<commit_message>
Add study area sample location
</commit_message>
<xml_diff>
--- a/result.docx
+++ b/result.docx
@@ -2,6 +2,93 @@
 <file path=word/document.xml><?xml version="1.0" encoding="utf-8"?>
 <w:document xmlns:wpc="http://schemas.microsoft.com/office/word/2010/wordprocessingCanvas" xmlns:cx="http://schemas.microsoft.com/office/drawing/2014/chartex" xmlns:cx1="http://schemas.microsoft.com/office/drawing/2015/9/8/chartex" xmlns:cx2="http://schemas.microsoft.com/office/drawing/2015/10/21/chartex" xmlns:cx3="http://schemas.microsoft.com/office/drawing/2016/5/9/chartex" xmlns:cx4="http://schemas.microsoft.com/office/drawing/2016/5/10/chartex" xmlns:cx5="http://schemas.microsoft.com/office/drawing/2016/5/11/chartex" xmlns:cx6="http://schemas.microsoft.com/office/drawing/2016/5/12/chartex" xmlns:cx7="http://schemas.microsoft.com/office/drawing/2016/5/13/chartex" xmlns:cx8="http://schemas.microsoft.com/office/drawing/2016/5/14/chartex" xmlns:mc="http://schemas.openxmlformats.org/markup-compatibility/2006" xmlns:aink="http://schemas.microsoft.com/office/drawing/2016/ink" xmlns:am3d="http://schemas.microsoft.com/office/drawing/2017/model3d" xmlns:o="urn:schemas-microsoft-com:office:office" xmlns:oel="http://schemas.microsoft.com/office/2019/extlst" xmlns:r="http://schemas.openxmlformats.org/officeDocument/2006/relationships" xmlns:m="http://schemas.openxmlformats.org/officeDocument/2006/math" xmlns:v="urn:schemas-microsoft-com:vml" xmlns:wp14="http://schemas.microsoft.com/office/word/2010/wordprocessingDrawing" xmlns:wp="http://schemas.openxmlformats.org/drawingml/2006/wordprocessingDrawing" xmlns:w10="urn:schemas-microsoft-com:office:word" xmlns:w="http://schemas.openxmlformats.org/wordprocessingml/2006/main" xmlns:w14="http://schemas.microsoft.com/office/word/2010/wordml" xmlns:w15="http://schemas.microsoft.com/office/word/2012/wordml" xmlns:w16cex="http://schemas.microsoft.com/office/word/2018/wordml/cex" xmlns:w16cid="http://schemas.microsoft.com/office/word/2016/wordml/cid" xmlns:w16="http://schemas.microsoft.com/office/word/2018/wordml" xmlns:w16du="http://schemas.microsoft.com/office/word/2023/wordml/word16du" xmlns:w16sdtdh="http://schemas.microsoft.com/office/word/2020/wordml/sdtdatahash" xmlns:w16sdtfl="http://schemas.microsoft.com/office/word/2024/wordml/sdtformatlock" xmlns:w16se="http://schemas.microsoft.com/office/word/2015/wordml/symex" xmlns:wpg="http://schemas.microsoft.com/office/word/2010/wordprocessingGroup" xmlns:wpi="http://schemas.microsoft.com/office/word/2010/wordprocessingInk" xmlns:wne="http://schemas.microsoft.com/office/word/2006/wordml" xmlns:wps="http://schemas.microsoft.com/office/word/2010/wordprocessingShape" mc:Ignorable="w14 w15 w16se w16cid w16 w16cex w16sdtdh w16sdtfl w16du wp14">
   <w:body>
+    <w:p>
+      <w:r>
+        <w:rPr>
+          <w:b/>
+        </w:rPr>
+        <w:t xml:space="preserve">2. Material and Methodology</w:t>
+      </w:r>
+    </w:p>
+    <w:p>
+      <w:r>
+        <w:rPr>
+          <w:b/>
+        </w:rPr>
+        <w:t xml:space="preserve">2.1 Area of Study</w:t>
+      </w:r>
+    </w:p>
+    <w:p>
+      <w:r>
+        <w:t xml:space="preserve">The sample collection and culture study area was located along the coastal waters of the Jaffna Peninsula, Sri Lanka, associated with the Palk Strait near Velanai/Thurayoor, Jaffna. The map reference provided for the sampling site shows approximately 9Â°40'01.6"N, 80Â°01'52.9"E (9.6671Â°N, 80.0314Â°E). The broader study area is within the northern coastal region of Sri Lanka, approximately 79.50Â°E-81.25Â°E and 9.25Â°N-10.00Â°N.</w:t>
+      </w:r>
+    </w:p>
+    <w:p>
+      <w:pPr>
+        <w:spacing w:line="360" w:lineRule="auto"/>
+        <w:rPr>
+          <w:rFonts w:ascii="Times New Roman" w:hAnsi="Times New Roman" w:cs="Times New Roman"/>
+          <w:b/>
+          <w:bCs/>
+        </w:rPr>
+      </w:pPr>
+      <w:r>
+        <w:rPr>
+          <w:rFonts w:ascii="Times New Roman" w:hAnsi="Times New Roman" w:cs="Times New Roman"/>
+          <w:noProof/>
+        </w:rPr>
+        <w:lastRenderedPageBreak/>
+        <w:drawing>
+          <wp:inline distT="0" distB="0" distL="0" distR="0" wp14:anchorId="024D6772" wp14:editId="62F881AB">
+            <wp:extent cx="5943600" cy="3109595"/>
+            <wp:effectExtent l="0" t="0" r="0" b="0"/>
+            <wp:docPr id="2128194489" name="Study Area Map"/>
+            <wp:cNvGraphicFramePr>
+              <a:graphicFrameLocks xmlns:a="http://schemas.openxmlformats.org/drawingml/2006/main" noChangeAspect="1"/>
+            </wp:cNvGraphicFramePr>
+            <a:graphic xmlns:a="http://schemas.openxmlformats.org/drawingml/2006/main">
+              <a:graphicData uri="http://schemas.openxmlformats.org/drawingml/2006/picture">
+                <pic:pic xmlns:pic="http://schemas.openxmlformats.org/drawingml/2006/picture">
+                  <pic:nvPicPr>
+                    <pic:cNvPr id="820271667" name="Picture 820271667"/>
+                    <pic:cNvPicPr/>
+                  </pic:nvPicPr>
+                  <pic:blipFill>
+                    <a:blip r:embed="rId33" cstate="print">
+                      <a:extLst>
+                        <a:ext uri="{28A0092B-C50C-407E-A947-70E740481C1C}">
+                          <a14:useLocalDpi xmlns:a14="http://schemas.microsoft.com/office/drawing/2010/main" val="0"/>
+                        </a:ext>
+                      </a:extLst>
+                    </a:blip>
+                    <a:stretch>
+                      <a:fillRect/>
+                    </a:stretch>
+                  </pic:blipFill>
+                  <pic:spPr>
+                    <a:xfrm>
+                      <a:off x="0" y="0"/>
+                      <a:ext cx="5943600" cy="3109595"/>
+                    </a:xfrm>
+                    <a:prstGeom prst="rect">
+                      <a:avLst/>
+                    </a:prstGeom>
+                  </pic:spPr>
+                </pic:pic>
+              </a:graphicData>
+            </a:graphic>
+          </wp:inline>
+        </w:drawing>
+      </w:r>
+    </w:p>
+    <w:p>
+      <w:r>
+        <w:rPr>
+          <w:b/>
+        </w:rPr>
+        <w:t xml:space="preserve">Figure M1: Map reference showing the sample collection area near the Palk Strait, Jaffna Peninsula, Sri Lanka.</w:t>
+      </w:r>
+    </w:p>
     <w:p>
       <w:pPr>
         <w:spacing w:line="360" w:lineRule="auto"/>
@@ -1607,7 +1694,7 @@
           <w:b/>
           <w:bCs/>
         </w:rPr>
-        <w:t xml:space="preserve">Table 2: Descriptive Statistics and WelchÃƒÆ’Ã†â€™Ãƒâ€šÃ‚Â¢ÃƒÆ’Ã‚Â¢ÃƒÂ¢Ã¢â€šÂ¬Ã…Â¡Ãƒâ€šÃ‚Â¬ÃƒÆ’Ã‚Â¢ÃƒÂ¢Ã¢â€šÂ¬Ã…Â¾Ãƒâ€šÃ‚Â¢s t-test Results for </w:t>
+        <w:t xml:space="preserve">Table 2: Descriptive Statistics and WelchÃƒÆ’Ã†â€™Ãƒâ€ Ã¢â‚¬â„¢ÃƒÆ’Ã¢â‚¬Â ÃƒÂ¢Ã¢â€šÂ¬Ã¢â€žÂ¢ÃƒÆ’Ã†â€™ÃƒÂ¢Ã¢â€šÂ¬Ã…Â¡ÃƒÆ’Ã¢â‚¬Å¡Ãƒâ€šÃ‚Â¢ÃƒÆ’Ã†â€™Ãƒâ€ Ã¢â‚¬â„¢ÃƒÆ’Ã¢â‚¬Å¡Ãƒâ€šÃ‚Â¢ÃƒÆ’Ã†â€™Ãƒâ€šÃ‚Â¢ÃƒÆ’Ã‚Â¢ÃƒÂ¢Ã¢â€šÂ¬Ã…Â¡Ãƒâ€šÃ‚Â¬ÃƒÆ’Ã¢â‚¬Â¦Ãƒâ€šÃ‚Â¡ÃƒÆ’Ã†â€™ÃƒÂ¢Ã¢â€šÂ¬Ã…Â¡ÃƒÆ’Ã¢â‚¬Å¡Ãƒâ€šÃ‚Â¬ÃƒÆ’Ã†â€™Ãƒâ€ Ã¢â‚¬â„¢ÃƒÆ’Ã¢â‚¬Å¡Ãƒâ€šÃ‚Â¢ÃƒÆ’Ã†â€™Ãƒâ€šÃ‚Â¢ÃƒÆ’Ã‚Â¢ÃƒÂ¢Ã¢â€šÂ¬Ã…Â¡Ãƒâ€šÃ‚Â¬ÃƒÆ’Ã¢â‚¬Â¦Ãƒâ€šÃ‚Â¾ÃƒÆ’Ã†â€™ÃƒÂ¢Ã¢â€šÂ¬Ã…Â¡ÃƒÆ’Ã¢â‚¬Å¡Ãƒâ€šÃ‚Â¢s t-test Results for </w:t>
       </w:r>
       <w:r>
         <w:rPr>
@@ -2264,21 +2351,21 @@
         <w:rPr>
           <w:rFonts w:ascii="Times New Roman" w:hAnsi="Times New Roman" w:cs="Times New Roman"/>
         </w:rPr>
-        <w:t xml:space="preserve"> in IMTA and Monoculture systems across four sampling intervals. Overall, both systems show fluctuating growth patterns, including periods of weight loss and recovery. In the early phase (Wk2ÃƒÆ’Ã†â€™Ãƒâ€šÃ‚Â¢ÃƒÆ’Ã‚Â¢ÃƒÂ¢Ã¢â€šÂ¬Ã…Â¡Ãƒâ€šÃ‚Â¬ÃƒÆ’Ã‚Â¢ÃƒÂ¢Ã¢â‚¬Å¡Ã‚Â¬Ãƒâ€¦Ã¢â‚¬Å“Wk3), both treatments recorded negative growth rates, with the IMTA system showing a sharper decline (-5.953 g/day) compared to the Monoculture (-2.916 g/day). During the recovery phase (Wk3ÃƒÆ’Ã†â€™Ãƒâ€šÃ‚Â¢ÃƒÆ’Ã‚Â¢ÃƒÂ¢Ã¢â€šÂ¬Ã…Â¡Ãƒâ€šÃ‚Â¬ÃƒÆ’Ã‚Â¢ÃƒÂ¢Ã¢â‚¬Å¡Ã‚Â¬Ãƒâ€¦Ã¢â‚¬Å“Wk4), both systems experienced strong positive growth, with Monoculture slightly higher (10.370 g/day) than IMTA (9.087 g/day).</w:t>
-      </w:r>
-    </w:p>
-    <w:p>
-      <w:pPr>
-        <w:spacing w:line="360" w:lineRule="auto"/>
-        <w:rPr>
-          <w:rFonts w:ascii="Times New Roman" w:hAnsi="Times New Roman" w:cs="Times New Roman"/>
-        </w:rPr>
-      </w:pPr>
-      <w:r>
-        <w:rPr>
-          <w:rFonts w:ascii="Times New Roman" w:hAnsi="Times New Roman" w:cs="Times New Roman"/>
-        </w:rPr>
-        <w:t xml:space="preserve">A major divergence occurred in the Wk4ÃƒÆ’Ã†â€™Ãƒâ€šÃ‚Â¢ÃƒÆ’Ã‚Â¢ÃƒÂ¢Ã¢â€šÂ¬Ã…Â¡Ãƒâ€šÃ‚Â¬ÃƒÆ’Ã‚Â¢ÃƒÂ¢Ã¢â‚¬Å¡Ã‚Â¬Ãƒâ€¦Ã¢â‚¬Å“Wk5 interval, where the Monoculture system showed a severe drop in growth (-27.608 g/day), while the IMTA system only recorded a minor decline (-2.266 g/day), indicating greater stability in the IMTA setup. In the final interval (Wk5ÃƒÆ’Ã†â€™Ãƒâ€šÃ‚Â¢ÃƒÆ’Ã‚Â¢ÃƒÂ¢Ã¢â€šÂ¬Ã…Â¡Ãƒâ€šÃ‚Â¬ÃƒÆ’Ã‚Â¢ÃƒÂ¢Ã¢â‚¬Å¡Ã‚Â¬Ãƒâ€¦Ã¢â‚¬Å“Wk6), both systems recovered again, with Monoculture reaching the highest AGR (13.854 g/day) and IMTA recording 8.307 g/day. Overall, although the Monoculture system achieved higher peak growth rates, the IMTA system demonstrated more stable and consistent growth performance, </w:t>
+        <w:t xml:space="preserve"> in IMTA and Monoculture systems across four sampling intervals. Overall, both systems show fluctuating growth patterns, including periods of weight loss and recovery. In the early phase (Wk2ÃƒÆ’Ã†â€™Ãƒâ€ Ã¢â‚¬â„¢ÃƒÆ’Ã¢â‚¬Â ÃƒÂ¢Ã¢â€šÂ¬Ã¢â€žÂ¢ÃƒÆ’Ã†â€™ÃƒÂ¢Ã¢â€šÂ¬Ã…Â¡ÃƒÆ’Ã¢â‚¬Å¡Ãƒâ€šÃ‚Â¢ÃƒÆ’Ã†â€™Ãƒâ€ Ã¢â‚¬â„¢ÃƒÆ’Ã¢â‚¬Å¡Ãƒâ€šÃ‚Â¢ÃƒÆ’Ã†â€™Ãƒâ€šÃ‚Â¢ÃƒÆ’Ã‚Â¢ÃƒÂ¢Ã¢â€šÂ¬Ã…Â¡Ãƒâ€šÃ‚Â¬ÃƒÆ’Ã¢â‚¬Â¦Ãƒâ€šÃ‚Â¡ÃƒÆ’Ã†â€™ÃƒÂ¢Ã¢â€šÂ¬Ã…Â¡ÃƒÆ’Ã¢â‚¬Å¡Ãƒâ€šÃ‚Â¬ÃƒÆ’Ã†â€™Ãƒâ€ Ã¢â‚¬â„¢ÃƒÆ’Ã¢â‚¬Å¡Ãƒâ€šÃ‚Â¢ÃƒÆ’Ã†â€™Ãƒâ€šÃ‚Â¢ÃƒÆ’Ã‚Â¢ÃƒÂ¢Ã¢â‚¬Å¡Ã‚Â¬Ãƒâ€¦Ã‚Â¡ÃƒÆ’Ã¢â‚¬Å¡Ãƒâ€šÃ‚Â¬ÃƒÆ’Ã†â€™ÃƒÂ¢Ã¢â€šÂ¬Ã‚Â¦ÃƒÆ’Ã‚Â¢ÃƒÂ¢Ã¢â‚¬Å¡Ã‚Â¬Ãƒâ€¦Ã¢â‚¬Å“Wk3), both treatments recorded negative growth rates, with the IMTA system showing a sharper decline (-5.953 g/day) compared to the Monoculture (-2.916 g/day). During the recovery phase (Wk3ÃƒÆ’Ã†â€™Ãƒâ€ Ã¢â‚¬â„¢ÃƒÆ’Ã¢â‚¬Â ÃƒÂ¢Ã¢â€šÂ¬Ã¢â€žÂ¢ÃƒÆ’Ã†â€™ÃƒÂ¢Ã¢â€šÂ¬Ã…Â¡ÃƒÆ’Ã¢â‚¬Å¡Ãƒâ€šÃ‚Â¢ÃƒÆ’Ã†â€™Ãƒâ€ Ã¢â‚¬â„¢ÃƒÆ’Ã¢â‚¬Å¡Ãƒâ€šÃ‚Â¢ÃƒÆ’Ã†â€™Ãƒâ€šÃ‚Â¢ÃƒÆ’Ã‚Â¢ÃƒÂ¢Ã¢â€šÂ¬Ã…Â¡Ãƒâ€šÃ‚Â¬ÃƒÆ’Ã¢â‚¬Â¦Ãƒâ€šÃ‚Â¡ÃƒÆ’Ã†â€™ÃƒÂ¢Ã¢â€šÂ¬Ã…Â¡ÃƒÆ’Ã¢â‚¬Å¡Ãƒâ€šÃ‚Â¬ÃƒÆ’Ã†â€™Ãƒâ€ Ã¢â‚¬â„¢ÃƒÆ’Ã¢â‚¬Å¡Ãƒâ€šÃ‚Â¢ÃƒÆ’Ã†â€™Ãƒâ€šÃ‚Â¢ÃƒÆ’Ã‚Â¢ÃƒÂ¢Ã¢â‚¬Å¡Ã‚Â¬Ãƒâ€¦Ã‚Â¡ÃƒÆ’Ã¢â‚¬Å¡Ãƒâ€šÃ‚Â¬ÃƒÆ’Ã†â€™ÃƒÂ¢Ã¢â€šÂ¬Ã‚Â¦ÃƒÆ’Ã‚Â¢ÃƒÂ¢Ã¢â‚¬Å¡Ã‚Â¬Ãƒâ€¦Ã¢â‚¬Å“Wk4), both systems experienced strong positive growth, with Monoculture slightly higher (10.370 g/day) than IMTA (9.087 g/day).</w:t>
+      </w:r>
+    </w:p>
+    <w:p>
+      <w:pPr>
+        <w:spacing w:line="360" w:lineRule="auto"/>
+        <w:rPr>
+          <w:rFonts w:ascii="Times New Roman" w:hAnsi="Times New Roman" w:cs="Times New Roman"/>
+        </w:rPr>
+      </w:pPr>
+      <w:r>
+        <w:rPr>
+          <w:rFonts w:ascii="Times New Roman" w:hAnsi="Times New Roman" w:cs="Times New Roman"/>
+        </w:rPr>
+        <w:t xml:space="preserve">A major divergence occurred in the Wk4ÃƒÆ’Ã†â€™Ãƒâ€ Ã¢â‚¬â„¢ÃƒÆ’Ã¢â‚¬Â ÃƒÂ¢Ã¢â€šÂ¬Ã¢â€žÂ¢ÃƒÆ’Ã†â€™ÃƒÂ¢Ã¢â€šÂ¬Ã…Â¡ÃƒÆ’Ã¢â‚¬Å¡Ãƒâ€šÃ‚Â¢ÃƒÆ’Ã†â€™Ãƒâ€ Ã¢â‚¬â„¢ÃƒÆ’Ã¢â‚¬Å¡Ãƒâ€šÃ‚Â¢ÃƒÆ’Ã†â€™Ãƒâ€šÃ‚Â¢ÃƒÆ’Ã‚Â¢ÃƒÂ¢Ã¢â€šÂ¬Ã…Â¡Ãƒâ€šÃ‚Â¬ÃƒÆ’Ã¢â‚¬Â¦Ãƒâ€šÃ‚Â¡ÃƒÆ’Ã†â€™ÃƒÂ¢Ã¢â€šÂ¬Ã…Â¡ÃƒÆ’Ã¢â‚¬Å¡Ãƒâ€šÃ‚Â¬ÃƒÆ’Ã†â€™Ãƒâ€ Ã¢â‚¬â„¢ÃƒÆ’Ã¢â‚¬Å¡Ãƒâ€šÃ‚Â¢ÃƒÆ’Ã†â€™Ãƒâ€šÃ‚Â¢ÃƒÆ’Ã‚Â¢ÃƒÂ¢Ã¢â‚¬Å¡Ã‚Â¬Ãƒâ€¦Ã‚Â¡ÃƒÆ’Ã¢â‚¬Å¡Ãƒâ€šÃ‚Â¬ÃƒÆ’Ã†â€™ÃƒÂ¢Ã¢â€šÂ¬Ã‚Â¦ÃƒÆ’Ã‚Â¢ÃƒÂ¢Ã¢â‚¬Å¡Ã‚Â¬Ãƒâ€¦Ã¢â‚¬Å“Wk5 interval, where the Monoculture system showed a severe drop in growth (-27.608 g/day), while the IMTA system only recorded a minor decline (-2.266 g/day), indicating greater stability in the IMTA setup. In the final interval (Wk5ÃƒÆ’Ã†â€™Ãƒâ€ Ã¢â‚¬â„¢ÃƒÆ’Ã¢â‚¬Â ÃƒÂ¢Ã¢â€šÂ¬Ã¢â€žÂ¢ÃƒÆ’Ã†â€™ÃƒÂ¢Ã¢â€šÂ¬Ã…Â¡ÃƒÆ’Ã¢â‚¬Å¡Ãƒâ€šÃ‚Â¢ÃƒÆ’Ã†â€™Ãƒâ€ Ã¢â‚¬â„¢ÃƒÆ’Ã¢â‚¬Å¡Ãƒâ€šÃ‚Â¢ÃƒÆ’Ã†â€™Ãƒâ€šÃ‚Â¢ÃƒÆ’Ã‚Â¢ÃƒÂ¢Ã¢â€šÂ¬Ã…Â¡Ãƒâ€šÃ‚Â¬ÃƒÆ’Ã¢â‚¬Â¦Ãƒâ€šÃ‚Â¡ÃƒÆ’Ã†â€™ÃƒÂ¢Ã¢â€šÂ¬Ã…Â¡ÃƒÆ’Ã¢â‚¬Å¡Ãƒâ€šÃ‚Â¬ÃƒÆ’Ã†â€™Ãƒâ€ Ã¢â‚¬â„¢ÃƒÆ’Ã¢â‚¬Å¡Ãƒâ€šÃ‚Â¢ÃƒÆ’Ã†â€™Ãƒâ€šÃ‚Â¢ÃƒÆ’Ã‚Â¢ÃƒÂ¢Ã¢â‚¬Å¡Ã‚Â¬Ãƒâ€¦Ã‚Â¡ÃƒÆ’Ã¢â‚¬Å¡Ãƒâ€šÃ‚Â¬ÃƒÆ’Ã†â€™ÃƒÂ¢Ã¢â€šÂ¬Ã‚Â¦ÃƒÆ’Ã‚Â¢ÃƒÂ¢Ã¢â‚¬Å¡Ã‚Â¬Ãƒâ€¦Ã¢â‚¬Å“Wk6), both systems recovered again, with Monoculture reaching the highest AGR (13.854 g/day) and IMTA recording 8.307 g/day. Overall, although the Monoculture system achieved higher peak growth rates, the IMTA system demonstrated more stable and consistent growth performance, </w:t>
       </w:r>
       <w:r>
         <w:rPr>
@@ -2379,21 +2466,21 @@
         <w:rPr>
           <w:rFonts w:ascii="Times New Roman" w:hAnsi="Times New Roman" w:cs="Times New Roman"/>
         </w:rPr>
-        <w:t xml:space="preserve"> (%/day) in IMTA and Monoculture systems across four sampling intervals. Overall, both treatments show fluctuating growth patterns, including phases of weight loss and recovery. During the initial adaptation phase (Wk2ÃƒÆ’Ã†â€™Ãƒâ€šÃ‚Â¢ÃƒÆ’Ã‚Â¢ÃƒÂ¢Ã¢â€šÂ¬Ã…Â¡Ãƒâ€šÃ‚Â¬ÃƒÆ’Ã‚Â¢ÃƒÂ¢Ã¢â‚¬Å¡Ã‚Â¬Ãƒâ€¦Ã¢â‚¬Å“Wk3), both systems recorded negative growth, with the IMTA group showing a slightly greater decline (-1.977%/day) compared to Monoculture (-0.985%/day). In the subsequent phase (Wk3ÃƒÆ’Ã†â€™Ãƒâ€šÃ‚Â¢ÃƒÆ’Ã‚Â¢ÃƒÂ¢Ã¢â€šÂ¬Ã…Â¡Ãƒâ€šÃ‚Â¬ÃƒÆ’Ã‚Â¢ÃƒÂ¢Ã¢â‚¬Å¡Ã‚Â¬Ãƒâ€¦Ã¢â‚¬Å“Wk4), both systems recovered strongly, with Monoculture showing a slightly higher growth rate (3.227%/day) than IMTA (2.958%/day).</w:t>
-      </w:r>
-    </w:p>
-    <w:p>
-      <w:pPr>
-        <w:spacing w:line="360" w:lineRule="auto"/>
-        <w:rPr>
-          <w:rFonts w:ascii="Times New Roman" w:hAnsi="Times New Roman" w:cs="Times New Roman"/>
-        </w:rPr>
-      </w:pPr>
-      <w:r>
-        <w:rPr>
-          <w:rFonts w:ascii="Times New Roman" w:hAnsi="Times New Roman" w:cs="Times New Roman"/>
-        </w:rPr>
-        <w:t xml:space="preserve">A clear difference in stability is observed during the Wk4ÃƒÆ’Ã†â€™Ãƒâ€šÃ‚Â¢ÃƒÆ’Ã‚Â¢ÃƒÂ¢Ã¢â€šÂ¬Ã…Â¡Ãƒâ€šÃ‚Â¬ÃƒÆ’Ã‚Â¢ÃƒÂ¢Ã¢â‚¬Å¡Ã‚Â¬Ãƒâ€¦Ã¢â‚¬Å“Wk5 interval, where the IMTA system remained relatively stable with a minor decline (-0.668%/day), while the Monoculture system experienced a sharp drop in growth (-9.516%/day), indicating strong physiological stress. In the final phase (Wk5ÃƒÆ’Ã†â€™Ãƒâ€šÃ‚Â¢ÃƒÆ’Ã‚Â¢ÃƒÂ¢Ã¢â€šÂ¬Ã…Â¡Ãƒâ€šÃ‚Â¬ÃƒÆ’Ã‚Â¢ÃƒÂ¢Ã¢â‚¬Å¡Ã‚Â¬Ãƒâ€¦Ã¢â‚¬Å“Wk6), both systems recovered, with Monoculture reaching a higher peak growth rate (4.872%/day) compared to IMTA (2.246%/day). Overall, although Monoculture showed higher peak SGR values, the IMTA system demonstrated more stable and consistent </w:t>
+        <w:t xml:space="preserve"> (%/day) in IMTA and Monoculture systems across four sampling intervals. Overall, both treatments show fluctuating growth patterns, including phases of weight loss and recovery. During the initial adaptation phase (Wk2ÃƒÆ’Ã†â€™Ãƒâ€ Ã¢â‚¬â„¢ÃƒÆ’Ã¢â‚¬Â ÃƒÂ¢Ã¢â€šÂ¬Ã¢â€žÂ¢ÃƒÆ’Ã†â€™ÃƒÂ¢Ã¢â€šÂ¬Ã…Â¡ÃƒÆ’Ã¢â‚¬Å¡Ãƒâ€šÃ‚Â¢ÃƒÆ’Ã†â€™Ãƒâ€ Ã¢â‚¬â„¢ÃƒÆ’Ã¢â‚¬Å¡Ãƒâ€šÃ‚Â¢ÃƒÆ’Ã†â€™Ãƒâ€šÃ‚Â¢ÃƒÆ’Ã‚Â¢ÃƒÂ¢Ã¢â€šÂ¬Ã…Â¡Ãƒâ€šÃ‚Â¬ÃƒÆ’Ã¢â‚¬Â¦Ãƒâ€šÃ‚Â¡ÃƒÆ’Ã†â€™ÃƒÂ¢Ã¢â€šÂ¬Ã…Â¡ÃƒÆ’Ã¢â‚¬Å¡Ãƒâ€šÃ‚Â¬ÃƒÆ’Ã†â€™Ãƒâ€ Ã¢â‚¬â„¢ÃƒÆ’Ã¢â‚¬Å¡Ãƒâ€šÃ‚Â¢ÃƒÆ’Ã†â€™Ãƒâ€šÃ‚Â¢ÃƒÆ’Ã‚Â¢ÃƒÂ¢Ã¢â‚¬Å¡Ã‚Â¬Ãƒâ€¦Ã‚Â¡ÃƒÆ’Ã¢â‚¬Å¡Ãƒâ€šÃ‚Â¬ÃƒÆ’Ã†â€™ÃƒÂ¢Ã¢â€šÂ¬Ã‚Â¦ÃƒÆ’Ã‚Â¢ÃƒÂ¢Ã¢â‚¬Å¡Ã‚Â¬Ãƒâ€¦Ã¢â‚¬Å“Wk3), both systems recorded negative growth, with the IMTA group showing a slightly greater decline (-1.977%/day) compared to Monoculture (-0.985%/day). In the subsequent phase (Wk3ÃƒÆ’Ã†â€™Ãƒâ€ Ã¢â‚¬â„¢ÃƒÆ’Ã¢â‚¬Â ÃƒÂ¢Ã¢â€šÂ¬Ã¢â€žÂ¢ÃƒÆ’Ã†â€™ÃƒÂ¢Ã¢â€šÂ¬Ã…Â¡ÃƒÆ’Ã¢â‚¬Å¡Ãƒâ€šÃ‚Â¢ÃƒÆ’Ã†â€™Ãƒâ€ Ã¢â‚¬â„¢ÃƒÆ’Ã¢â‚¬Å¡Ãƒâ€šÃ‚Â¢ÃƒÆ’Ã†â€™Ãƒâ€šÃ‚Â¢ÃƒÆ’Ã‚Â¢ÃƒÂ¢Ã¢â€šÂ¬Ã…Â¡Ãƒâ€šÃ‚Â¬ÃƒÆ’Ã¢â‚¬Â¦Ãƒâ€šÃ‚Â¡ÃƒÆ’Ã†â€™ÃƒÂ¢Ã¢â€šÂ¬Ã…Â¡ÃƒÆ’Ã¢â‚¬Å¡Ãƒâ€šÃ‚Â¬ÃƒÆ’Ã†â€™Ãƒâ€ Ã¢â‚¬â„¢ÃƒÆ’Ã¢â‚¬Å¡Ãƒâ€šÃ‚Â¢ÃƒÆ’Ã†â€™Ãƒâ€šÃ‚Â¢ÃƒÆ’Ã‚Â¢ÃƒÂ¢Ã¢â‚¬Å¡Ã‚Â¬Ãƒâ€¦Ã‚Â¡ÃƒÆ’Ã¢â‚¬Å¡Ãƒâ€šÃ‚Â¬ÃƒÆ’Ã†â€™ÃƒÂ¢Ã¢â€šÂ¬Ã‚Â¦ÃƒÆ’Ã‚Â¢ÃƒÂ¢Ã¢â‚¬Å¡Ã‚Â¬Ãƒâ€¦Ã¢â‚¬Å“Wk4), both systems recovered strongly, with Monoculture showing a slightly higher growth rate (3.227%/day) than IMTA (2.958%/day).</w:t>
+      </w:r>
+    </w:p>
+    <w:p>
+      <w:pPr>
+        <w:spacing w:line="360" w:lineRule="auto"/>
+        <w:rPr>
+          <w:rFonts w:ascii="Times New Roman" w:hAnsi="Times New Roman" w:cs="Times New Roman"/>
+        </w:rPr>
+      </w:pPr>
+      <w:r>
+        <w:rPr>
+          <w:rFonts w:ascii="Times New Roman" w:hAnsi="Times New Roman" w:cs="Times New Roman"/>
+        </w:rPr>
+        <w:t xml:space="preserve">A clear difference in stability is observed during the Wk4ÃƒÆ’Ã†â€™Ãƒâ€ Ã¢â‚¬â„¢ÃƒÆ’Ã¢â‚¬Â ÃƒÂ¢Ã¢â€šÂ¬Ã¢â€žÂ¢ÃƒÆ’Ã†â€™ÃƒÂ¢Ã¢â€šÂ¬Ã…Â¡ÃƒÆ’Ã¢â‚¬Å¡Ãƒâ€šÃ‚Â¢ÃƒÆ’Ã†â€™Ãƒâ€ Ã¢â‚¬â„¢ÃƒÆ’Ã¢â‚¬Å¡Ãƒâ€šÃ‚Â¢ÃƒÆ’Ã†â€™Ãƒâ€šÃ‚Â¢ÃƒÆ’Ã‚Â¢ÃƒÂ¢Ã¢â€šÂ¬Ã…Â¡Ãƒâ€šÃ‚Â¬ÃƒÆ’Ã¢â‚¬Â¦Ãƒâ€šÃ‚Â¡ÃƒÆ’Ã†â€™ÃƒÂ¢Ã¢â€šÂ¬Ã…Â¡ÃƒÆ’Ã¢â‚¬Å¡Ãƒâ€šÃ‚Â¬ÃƒÆ’Ã†â€™Ãƒâ€ Ã¢â‚¬â„¢ÃƒÆ’Ã¢â‚¬Å¡Ãƒâ€šÃ‚Â¢ÃƒÆ’Ã†â€™Ãƒâ€šÃ‚Â¢ÃƒÆ’Ã‚Â¢ÃƒÂ¢Ã¢â‚¬Å¡Ã‚Â¬Ãƒâ€¦Ã‚Â¡ÃƒÆ’Ã¢â‚¬Å¡Ãƒâ€šÃ‚Â¬ÃƒÆ’Ã†â€™ÃƒÂ¢Ã¢â€šÂ¬Ã‚Â¦ÃƒÆ’Ã‚Â¢ÃƒÂ¢Ã¢â‚¬Å¡Ã‚Â¬Ãƒâ€¦Ã¢â‚¬Å“Wk5 interval, where the IMTA system remained relatively stable with a minor decline (-0.668%/day), while the Monoculture system experienced a sharp drop in growth (-9.516%/day), indicating strong physiological stress. In the final phase (Wk5ÃƒÆ’Ã†â€™Ãƒâ€ Ã¢â‚¬â„¢ÃƒÆ’Ã¢â‚¬Â ÃƒÂ¢Ã¢â€šÂ¬Ã¢â€žÂ¢ÃƒÆ’Ã†â€™ÃƒÂ¢Ã¢â€šÂ¬Ã…Â¡ÃƒÆ’Ã¢â‚¬Å¡Ãƒâ€šÃ‚Â¢ÃƒÆ’Ã†â€™Ãƒâ€ Ã¢â‚¬â„¢ÃƒÆ’Ã¢â‚¬Å¡Ãƒâ€šÃ‚Â¢ÃƒÆ’Ã†â€™Ãƒâ€šÃ‚Â¢ÃƒÆ’Ã‚Â¢ÃƒÂ¢Ã¢â€šÂ¬Ã…Â¡Ãƒâ€šÃ‚Â¬ÃƒÆ’Ã¢â‚¬Â¦Ãƒâ€šÃ‚Â¡ÃƒÆ’Ã†â€™ÃƒÂ¢Ã¢â€šÂ¬Ã…Â¡ÃƒÆ’Ã¢â‚¬Å¡Ãƒâ€šÃ‚Â¬ÃƒÆ’Ã†â€™Ãƒâ€ Ã¢â‚¬â„¢ÃƒÆ’Ã¢â‚¬Å¡Ãƒâ€šÃ‚Â¢ÃƒÆ’Ã†â€™Ãƒâ€šÃ‚Â¢ÃƒÆ’Ã‚Â¢ÃƒÂ¢Ã¢â‚¬Å¡Ã‚Â¬Ãƒâ€¦Ã‚Â¡ÃƒÆ’Ã¢â‚¬Å¡Ãƒâ€šÃ‚Â¬ÃƒÆ’Ã†â€™ÃƒÂ¢Ã¢â€šÂ¬Ã‚Â¦ÃƒÆ’Ã‚Â¢ÃƒÂ¢Ã¢â‚¬Å¡Ã‚Â¬Ãƒâ€¦Ã¢â‚¬Å“Wk6), both systems recovered, with Monoculture reaching a higher peak growth rate (4.872%/day) compared to IMTA (2.246%/day). Overall, although Monoculture showed higher peak SGR values, the IMTA system demonstrated more stable and consistent </w:t>
       </w:r>
       <w:r>
         <w:rPr>
@@ -5334,7 +5421,7 @@
         <w:rPr>
           <w:rFonts w:ascii="Times New Roman" w:hAnsi="Times New Roman" w:cs="Times New Roman"/>
         </w:rPr>
-        <w:t xml:space="preserve"> across three experimental replicates. Overall, the statistical analysis shows no significant difference in weight gain between the replicates, as indicated by the One-Way ANOVA result (p = 0.5416), which is well above the 0.05 significance level. This is further supported by the ÃƒÆ’Ã†â€™Ãƒâ€šÃ‚Â¢ÃƒÆ’Ã‚Â¢ÃƒÂ¢Ã¢â€šÂ¬Ã…Â¡Ãƒâ€šÃ‚Â¬ÃƒÆ’Ã¢â‚¬Â¦ÃƒÂ¢Ã¢â€šÂ¬Ã…â€œnsÃƒÆ’Ã†â€™Ãƒâ€šÃ‚Â¢ÃƒÆ’Ã‚Â¢ÃƒÂ¢Ã¢â€šÂ¬Ã…Â¡Ãƒâ€šÃ‚Â¬ÃƒÆ’Ã¢â‚¬Å¡Ãƒâ€šÃ‚Â (non-significant) labels in the pairwise comparisons, confirming that none of the replicates differed meaningfully from each other.</w:t>
+        <w:t xml:space="preserve"> across three experimental replicates. Overall, the statistical analysis shows no significant difference in weight gain between the replicates, as indicated by the One-Way ANOVA result (p = 0.5416), which is well above the 0.05 significance level. This is further supported by the ÃƒÆ’Ã†â€™Ãƒâ€ Ã¢â‚¬â„¢ÃƒÆ’Ã¢â‚¬Â ÃƒÂ¢Ã¢â€šÂ¬Ã¢â€žÂ¢ÃƒÆ’Ã†â€™ÃƒÂ¢Ã¢â€šÂ¬Ã…Â¡ÃƒÆ’Ã¢â‚¬Å¡Ãƒâ€šÃ‚Â¢ÃƒÆ’Ã†â€™Ãƒâ€ Ã¢â‚¬â„¢ÃƒÆ’Ã¢â‚¬Å¡Ãƒâ€šÃ‚Â¢ÃƒÆ’Ã†â€™Ãƒâ€šÃ‚Â¢ÃƒÆ’Ã‚Â¢ÃƒÂ¢Ã¢â€šÂ¬Ã…Â¡Ãƒâ€šÃ‚Â¬ÃƒÆ’Ã¢â‚¬Â¦Ãƒâ€šÃ‚Â¡ÃƒÆ’Ã†â€™ÃƒÂ¢Ã¢â€šÂ¬Ã…Â¡ÃƒÆ’Ã¢â‚¬Å¡Ãƒâ€šÃ‚Â¬ÃƒÆ’Ã†â€™Ãƒâ€ Ã¢â‚¬â„¢ÃƒÆ’Ã‚Â¢ÃƒÂ¢Ã¢â‚¬Å¡Ã‚Â¬Ãƒâ€šÃ‚Â¦ÃƒÆ’Ã†â€™Ãƒâ€šÃ‚Â¢ÃƒÆ’Ã‚Â¢ÃƒÂ¢Ã¢â€šÂ¬Ã…Â¡Ãƒâ€šÃ‚Â¬ÃƒÆ’Ã¢â‚¬Â¦ÃƒÂ¢Ã¢â€šÂ¬Ã…â€œnsÃƒÆ’Ã†â€™Ãƒâ€ Ã¢â‚¬â„¢ÃƒÆ’Ã¢â‚¬Â ÃƒÂ¢Ã¢â€šÂ¬Ã¢â€žÂ¢ÃƒÆ’Ã†â€™ÃƒÂ¢Ã¢â€šÂ¬Ã…Â¡ÃƒÆ’Ã¢â‚¬Å¡Ãƒâ€šÃ‚Â¢ÃƒÆ’Ã†â€™Ãƒâ€ Ã¢â‚¬â„¢ÃƒÆ’Ã¢â‚¬Å¡Ãƒâ€šÃ‚Â¢ÃƒÆ’Ã†â€™Ãƒâ€šÃ‚Â¢ÃƒÆ’Ã‚Â¢ÃƒÂ¢Ã¢â€šÂ¬Ã…Â¡Ãƒâ€šÃ‚Â¬ÃƒÆ’Ã¢â‚¬Â¦Ãƒâ€šÃ‚Â¡ÃƒÆ’Ã†â€™ÃƒÂ¢Ã¢â€šÂ¬Ã…Â¡ÃƒÆ’Ã¢â‚¬Å¡Ãƒâ€šÃ‚Â¬ÃƒÆ’Ã†â€™Ãƒâ€ Ã¢â‚¬â„¢ÃƒÆ’Ã‚Â¢ÃƒÂ¢Ã¢â‚¬Å¡Ã‚Â¬Ãƒâ€¦Ã‚Â¡ÃƒÆ’Ã†â€™ÃƒÂ¢Ã¢â€šÂ¬Ã…Â¡ÃƒÆ’Ã¢â‚¬Å¡Ãƒâ€šÃ‚Â (non-significant) labels in the pairwise comparisons, confirming that none of the replicates differed meaningfully from each other.</w:t>
       </w:r>
     </w:p>
     <w:p>
@@ -6192,7 +6279,7 @@
         <w:rPr>
           <w:rFonts w:ascii="Times New Roman" w:hAnsi="Times New Roman" w:cs="Times New Roman"/>
         </w:rPr>
-        <w:t>The line graph illustrates the weekly changes in Total Dissolved Solids (TDS), measured in parts per thousand (ppt), for Integrated Multi-Trophic Aquaculture (IMTA) and Monoculture treatments over a seven-week period. At the beginning of the study (Week 1), both treatments recorded identical TDS levels of approximately 16.5 ppt. During the early phase (Weeks 2ÃƒÆ’Ã†â€™Ãƒâ€šÃ‚Â¢ÃƒÆ’Ã‚Â¢ÃƒÂ¢Ã¢â€šÂ¬Ã…Â¡Ãƒâ€šÃ‚Â¬ÃƒÆ’Ã‚Â¢ÃƒÂ¢Ã¢â‚¬Å¡Ã‚Â¬Ãƒâ€¦Ã¢â‚¬Å“3), TDS levels increased in both systems, with the Monoculture treatment showing slightly higher values (around 18.6 ppt) compared to the IMTA system (approximately 18.1 ppt).</w:t>
+        <w:t>The line graph illustrates the weekly changes in Total Dissolved Solids (TDS), measured in parts per thousand (ppt), for Integrated Multi-Trophic Aquaculture (IMTA) and Monoculture treatments over a seven-week period. At the beginning of the study (Week 1), both treatments recorded identical TDS levels of approximately 16.5 ppt. During the early phase (Weeks 2ÃƒÆ’Ã†â€™Ãƒâ€ Ã¢â‚¬â„¢ÃƒÆ’Ã¢â‚¬Â ÃƒÂ¢Ã¢â€šÂ¬Ã¢â€žÂ¢ÃƒÆ’Ã†â€™ÃƒÂ¢Ã¢â€šÂ¬Ã…Â¡ÃƒÆ’Ã¢â‚¬Å¡Ãƒâ€šÃ‚Â¢ÃƒÆ’Ã†â€™Ãƒâ€ Ã¢â‚¬â„¢ÃƒÆ’Ã¢â‚¬Å¡Ãƒâ€šÃ‚Â¢ÃƒÆ’Ã†â€™Ãƒâ€šÃ‚Â¢ÃƒÆ’Ã‚Â¢ÃƒÂ¢Ã¢â€šÂ¬Ã…Â¡Ãƒâ€šÃ‚Â¬ÃƒÆ’Ã¢â‚¬Â¦Ãƒâ€šÃ‚Â¡ÃƒÆ’Ã†â€™ÃƒÂ¢Ã¢â€šÂ¬Ã…Â¡ÃƒÆ’Ã¢â‚¬Å¡Ãƒâ€šÃ‚Â¬ÃƒÆ’Ã†â€™Ãƒâ€ Ã¢â‚¬â„¢ÃƒÆ’Ã¢â‚¬Å¡Ãƒâ€šÃ‚Â¢ÃƒÆ’Ã†â€™Ãƒâ€šÃ‚Â¢ÃƒÆ’Ã‚Â¢ÃƒÂ¢Ã¢â‚¬Å¡Ã‚Â¬Ãƒâ€¦Ã‚Â¡ÃƒÆ’Ã¢â‚¬Å¡Ãƒâ€šÃ‚Â¬ÃƒÆ’Ã†â€™ÃƒÂ¢Ã¢â€šÂ¬Ã‚Â¦ÃƒÆ’Ã‚Â¢ÃƒÂ¢Ã¢â‚¬Å¡Ã‚Â¬Ãƒâ€¦Ã¢â‚¬Å“3), TDS levels increased in both systems, with the Monoculture treatment showing slightly higher values (around 18.6 ppt) compared to the IMTA system (approximately 18.1 ppt).</w:t>
       </w:r>
     </w:p>
     <w:p>
@@ -6438,21 +6525,21 @@
         <w:rPr>
           <w:rFonts w:ascii="Times New Roman" w:hAnsi="Times New Roman" w:cs="Times New Roman"/>
         </w:rPr>
-        <w:t>The line graph illustrates the weekly changes in salinity levels (measured in ppt) for Integrated Multi-Trophic Aquaculture (IMTA) and Monoculture treatments over a seven-week period. At the start of the study (Week 1), both treatments recorded identical salinity levels of approximately 20.6 ppt. During the early phase (Weeks 2ÃƒÆ’Ã†â€™Ãƒâ€šÃ‚Â¢ÃƒÆ’Ã‚Â¢ÃƒÂ¢Ã¢â€šÂ¬Ã…Â¡Ãƒâ€šÃ‚Â¬ÃƒÆ’Ã‚Â¢ÃƒÂ¢Ã¢â‚¬Å¡Ã‚Â¬Ãƒâ€¦Ã¢â‚¬Å“3), salinity increased in both systems; however, the Monoculture treatment consistently showed higher values (around 23.5 ppt) compared to the IMTA system (approximately 22.9 ppt).</w:t>
-      </w:r>
-    </w:p>
-    <w:p>
-      <w:pPr>
-        <w:spacing w:line="360" w:lineRule="auto"/>
-        <w:rPr>
-          <w:rFonts w:ascii="Times New Roman" w:hAnsi="Times New Roman" w:cs="Times New Roman"/>
-        </w:rPr>
-      </w:pPr>
-      <w:r>
-        <w:rPr>
-          <w:rFonts w:ascii="Times New Roman" w:hAnsi="Times New Roman" w:cs="Times New Roman"/>
-        </w:rPr>
-        <w:t xml:space="preserve">In the mid-phase of the study (Weeks 4ÃƒÆ’Ã†â€™Ãƒâ€šÃ‚Â¢ÃƒÆ’Ã‚Â¢ÃƒÂ¢Ã¢â€šÂ¬Ã…Â¡Ãƒâ€šÃ‚Â¬ÃƒÆ’Ã‚Â¢ÃƒÂ¢Ã¢â‚¬Å¡Ã‚Â¬Ãƒâ€¦Ã¢â‚¬Å“5), the salinity levels of both treatments briefly converged at about 21.5 ppt in Week 4. This was followed by a notable divergence in Week 5, where Monoculture salinity increased sharply to approximately 24.0 ppt, while the IMTA system </w:t>
+        <w:t>The line graph illustrates the weekly changes in salinity levels (measured in ppt) for Integrated Multi-Trophic Aquaculture (IMTA) and Monoculture treatments over a seven-week period. At the start of the study (Week 1), both treatments recorded identical salinity levels of approximately 20.6 ppt. During the early phase (Weeks 2ÃƒÆ’Ã†â€™Ãƒâ€ Ã¢â‚¬â„¢ÃƒÆ’Ã¢â‚¬Â ÃƒÂ¢Ã¢â€šÂ¬Ã¢â€žÂ¢ÃƒÆ’Ã†â€™ÃƒÂ¢Ã¢â€šÂ¬Ã…Â¡ÃƒÆ’Ã¢â‚¬Å¡Ãƒâ€šÃ‚Â¢ÃƒÆ’Ã†â€™Ãƒâ€ Ã¢â‚¬â„¢ÃƒÆ’Ã¢â‚¬Å¡Ãƒâ€šÃ‚Â¢ÃƒÆ’Ã†â€™Ãƒâ€šÃ‚Â¢ÃƒÆ’Ã‚Â¢ÃƒÂ¢Ã¢â€šÂ¬Ã…Â¡Ãƒâ€šÃ‚Â¬ÃƒÆ’Ã¢â‚¬Â¦Ãƒâ€šÃ‚Â¡ÃƒÆ’Ã†â€™ÃƒÂ¢Ã¢â€šÂ¬Ã…Â¡ÃƒÆ’Ã¢â‚¬Å¡Ãƒâ€šÃ‚Â¬ÃƒÆ’Ã†â€™Ãƒâ€ Ã¢â‚¬â„¢ÃƒÆ’Ã¢â‚¬Å¡Ãƒâ€šÃ‚Â¢ÃƒÆ’Ã†â€™Ãƒâ€šÃ‚Â¢ÃƒÆ’Ã‚Â¢ÃƒÂ¢Ã¢â‚¬Å¡Ã‚Â¬Ãƒâ€¦Ã‚Â¡ÃƒÆ’Ã¢â‚¬Å¡Ãƒâ€šÃ‚Â¬ÃƒÆ’Ã†â€™ÃƒÂ¢Ã¢â€šÂ¬Ã‚Â¦ÃƒÆ’Ã‚Â¢ÃƒÂ¢Ã¢â‚¬Å¡Ã‚Â¬Ãƒâ€¦Ã¢â‚¬Å“3), salinity increased in both systems; however, the Monoculture treatment consistently showed higher values (around 23.5 ppt) compared to the IMTA system (approximately 22.9 ppt).</w:t>
+      </w:r>
+    </w:p>
+    <w:p>
+      <w:pPr>
+        <w:spacing w:line="360" w:lineRule="auto"/>
+        <w:rPr>
+          <w:rFonts w:ascii="Times New Roman" w:hAnsi="Times New Roman" w:cs="Times New Roman"/>
+        </w:rPr>
+      </w:pPr>
+      <w:r>
+        <w:rPr>
+          <w:rFonts w:ascii="Times New Roman" w:hAnsi="Times New Roman" w:cs="Times New Roman"/>
+        </w:rPr>
+        <w:t xml:space="preserve">In the mid-phase of the study (Weeks 4ÃƒÆ’Ã†â€™Ãƒâ€ Ã¢â‚¬â„¢ÃƒÆ’Ã¢â‚¬Â ÃƒÂ¢Ã¢â€šÂ¬Ã¢â€žÂ¢ÃƒÆ’Ã†â€™ÃƒÂ¢Ã¢â€šÂ¬Ã…Â¡ÃƒÆ’Ã¢â‚¬Å¡Ãƒâ€šÃ‚Â¢ÃƒÆ’Ã†â€™Ãƒâ€ Ã¢â‚¬â„¢ÃƒÆ’Ã¢â‚¬Å¡Ãƒâ€šÃ‚Â¢ÃƒÆ’Ã†â€™Ãƒâ€šÃ‚Â¢ÃƒÆ’Ã‚Â¢ÃƒÂ¢Ã¢â€šÂ¬Ã…Â¡Ãƒâ€šÃ‚Â¬ÃƒÆ’Ã¢â‚¬Â¦Ãƒâ€šÃ‚Â¡ÃƒÆ’Ã†â€™ÃƒÂ¢Ã¢â€šÂ¬Ã…Â¡ÃƒÆ’Ã¢â‚¬Å¡Ãƒâ€šÃ‚Â¬ÃƒÆ’Ã†â€™Ãƒâ€ Ã¢â‚¬â„¢ÃƒÆ’Ã¢â‚¬Å¡Ãƒâ€šÃ‚Â¢ÃƒÆ’Ã†â€™Ãƒâ€šÃ‚Â¢ÃƒÆ’Ã‚Â¢ÃƒÂ¢Ã¢â‚¬Å¡Ã‚Â¬Ãƒâ€¦Ã‚Â¡ÃƒÆ’Ã¢â‚¬Å¡Ãƒâ€šÃ‚Â¬ÃƒÆ’Ã†â€™ÃƒÂ¢Ã¢â€šÂ¬Ã‚Â¦ÃƒÆ’Ã‚Â¢ÃƒÂ¢Ã¢â‚¬Å¡Ã‚Â¬Ãƒâ€¦Ã¢â‚¬Å“5), the salinity levels of both treatments briefly converged at about 21.5 ppt in Week 4. This was followed by a notable divergence in Week 5, where Monoculture salinity increased sharply to approximately 24.0 ppt, while the IMTA system </w:t>
       </w:r>
       <w:r>
         <w:rPr>
@@ -6836,7 +6923,7 @@
         <w:rPr>
           <w:rFonts w:ascii="Times New Roman" w:hAnsi="Times New Roman" w:cs="Times New Roman"/>
         </w:rPr>
-        <w:t>The line graph illustrates the weekly variation in water temperature (ÃƒÆ’Ã†â€™ÃƒÂ¢Ã¢â€šÂ¬Ã…Â¡ÃƒÆ’Ã¢â‚¬Å¡Ãƒâ€šÃ‚Â°C) in two aquaculture systems, Integrated Multi-Trophic Aquaculture (IMTA) and Monoculture, over a seven-week period. Overall, both treatments exhibited a very similar pattern of fluctuation throughout the study. At the beginning (Week 1), water temperature was relatively high in both systems, with Monoculture showing a slightly higher value (approximately 28.7ÃƒÆ’Ã†â€™ÃƒÂ¢Ã¢â€šÂ¬Ã…Â¡ÃƒÆ’Ã¢â‚¬Å¡Ãƒâ€šÃ‚Â°C) compared to IMTA (around 28.2ÃƒÆ’Ã†â€™ÃƒÂ¢Ã¢â€šÂ¬Ã…Â¡ÃƒÆ’Ã¢â‚¬Å¡Ãƒâ€šÃ‚Â°C). From Week 1 to Week 4, a clear declining trend was observed in both treatments, reaching the lowest temperatures at Week 4 (about 25.9ÃƒÆ’Ã†â€™ÃƒÂ¢Ã¢â€šÂ¬Ã…Â¡ÃƒÆ’Ã¢â‚¬Å¡Ãƒâ€šÃ‚Â°C in Monoculture and 25.7ÃƒÆ’Ã†â€™ÃƒÂ¢Ã¢â€šÂ¬Ã…Â¡ÃƒÆ’Ã¢â‚¬Å¡Ãƒâ€šÃ‚Â°C in IMTA). Following this decline, temperatures increased sharply in Week 5 and then remained relatively stable through Weeks 6 and 7 at approximately 28.1ÃƒÆ’Ã†â€™ÃƒÂ¢Ã¢â€šÂ¬Ã…Â¡ÃƒÆ’Ã¢â‚¬Å¡Ãƒâ€šÃ‚Â°C in both systems.</w:t>
+        <w:t>The line graph illustrates the weekly variation in water temperature (ÃƒÆ’Ã†â€™Ãƒâ€ Ã¢â‚¬â„¢ÃƒÆ’Ã¢â‚¬Â ÃƒÂ¢Ã¢â€šÂ¬Ã¢â€žÂ¢ÃƒÆ’Ã†â€™Ãƒâ€šÃ‚Â¢ÃƒÆ’Ã‚Â¢ÃƒÂ¢Ã¢â€šÂ¬Ã…Â¡Ãƒâ€šÃ‚Â¬ÃƒÆ’Ã¢â‚¬Â¦Ãƒâ€šÃ‚Â¡ÃƒÆ’Ã†â€™Ãƒâ€ Ã¢â‚¬â„¢ÃƒÆ’Ã‚Â¢ÃƒÂ¢Ã¢â‚¬Å¡Ã‚Â¬Ãƒâ€¦Ã‚Â¡ÃƒÆ’Ã†â€™ÃƒÂ¢Ã¢â€šÂ¬Ã…Â¡ÃƒÆ’Ã¢â‚¬Å¡Ãƒâ€šÃ‚Â°C) in two aquaculture systems, Integrated Multi-Trophic Aquaculture (IMTA) and Monoculture, over a seven-week period. Overall, both treatments exhibited a very similar pattern of fluctuation throughout the study. At the beginning (Week 1), water temperature was relatively high in both systems, with Monoculture showing a slightly higher value (approximately 28.7ÃƒÆ’Ã†â€™Ãƒâ€ Ã¢â‚¬â„¢ÃƒÆ’Ã¢â‚¬Â ÃƒÂ¢Ã¢â€šÂ¬Ã¢â€žÂ¢ÃƒÆ’Ã†â€™Ãƒâ€šÃ‚Â¢ÃƒÆ’Ã‚Â¢ÃƒÂ¢Ã¢â€šÂ¬Ã…Â¡Ãƒâ€šÃ‚Â¬ÃƒÆ’Ã¢â‚¬Â¦Ãƒâ€šÃ‚Â¡ÃƒÆ’Ã†â€™Ãƒâ€ Ã¢â‚¬â„¢ÃƒÆ’Ã‚Â¢ÃƒÂ¢Ã¢â‚¬Å¡Ã‚Â¬Ãƒâ€¦Ã‚Â¡ÃƒÆ’Ã†â€™ÃƒÂ¢Ã¢â€šÂ¬Ã…Â¡ÃƒÆ’Ã¢â‚¬Å¡Ãƒâ€šÃ‚Â°C) compared to IMTA (around 28.2ÃƒÆ’Ã†â€™Ãƒâ€ Ã¢â‚¬â„¢ÃƒÆ’Ã¢â‚¬Â ÃƒÂ¢Ã¢â€šÂ¬Ã¢â€žÂ¢ÃƒÆ’Ã†â€™Ãƒâ€šÃ‚Â¢ÃƒÆ’Ã‚Â¢ÃƒÂ¢Ã¢â€šÂ¬Ã…Â¡Ãƒâ€šÃ‚Â¬ÃƒÆ’Ã¢â‚¬Â¦Ãƒâ€šÃ‚Â¡ÃƒÆ’Ã†â€™Ãƒâ€ Ã¢â‚¬â„¢ÃƒÆ’Ã‚Â¢ÃƒÂ¢Ã¢â‚¬Å¡Ã‚Â¬Ãƒâ€¦Ã‚Â¡ÃƒÆ’Ã†â€™ÃƒÂ¢Ã¢â€šÂ¬Ã…Â¡ÃƒÆ’Ã¢â‚¬Å¡Ãƒâ€šÃ‚Â°C). From Week 1 to Week 4, a clear declining trend was observed in both treatments, reaching the lowest temperatures at Week 4 (about 25.9ÃƒÆ’Ã†â€™Ãƒâ€ Ã¢â‚¬â„¢ÃƒÆ’Ã¢â‚¬Â ÃƒÂ¢Ã¢â€šÂ¬Ã¢â€žÂ¢ÃƒÆ’Ã†â€™Ãƒâ€šÃ‚Â¢ÃƒÆ’Ã‚Â¢ÃƒÂ¢Ã¢â€šÂ¬Ã…Â¡Ãƒâ€šÃ‚Â¬ÃƒÆ’Ã¢â‚¬Â¦Ãƒâ€šÃ‚Â¡ÃƒÆ’Ã†â€™Ãƒâ€ Ã¢â‚¬â„¢ÃƒÆ’Ã‚Â¢ÃƒÂ¢Ã¢â‚¬Å¡Ã‚Â¬Ãƒâ€¦Ã‚Â¡ÃƒÆ’Ã†â€™ÃƒÂ¢Ã¢â€šÂ¬Ã…Â¡ÃƒÆ’Ã¢â‚¬Å¡Ãƒâ€šÃ‚Â°C in Monoculture and 25.7ÃƒÆ’Ã†â€™Ãƒâ€ Ã¢â‚¬â„¢ÃƒÆ’Ã¢â‚¬Â ÃƒÂ¢Ã¢â€šÂ¬Ã¢â€žÂ¢ÃƒÆ’Ã†â€™Ãƒâ€šÃ‚Â¢ÃƒÆ’Ã‚Â¢ÃƒÂ¢Ã¢â€šÂ¬Ã…Â¡Ãƒâ€šÃ‚Â¬ÃƒÆ’Ã¢â‚¬Â¦Ãƒâ€šÃ‚Â¡ÃƒÆ’Ã†â€™Ãƒâ€ Ã¢â‚¬â„¢ÃƒÆ’Ã‚Â¢ÃƒÂ¢Ã¢â‚¬Å¡Ã‚Â¬Ãƒâ€¦Ã‚Â¡ÃƒÆ’Ã†â€™ÃƒÂ¢Ã¢â€šÂ¬Ã…Â¡ÃƒÆ’Ã¢â‚¬Å¡Ãƒâ€šÃ‚Â°C in IMTA). Following this decline, temperatures increased sharply in Week 5 and then remained relatively stable through Weeks 6 and 7 at approximately 28.1ÃƒÆ’Ã†â€™Ãƒâ€ Ã¢â‚¬â„¢ÃƒÆ’Ã¢â‚¬Â ÃƒÂ¢Ã¢â€šÂ¬Ã¢â€žÂ¢ÃƒÆ’Ã†â€™Ãƒâ€šÃ‚Â¢ÃƒÆ’Ã‚Â¢ÃƒÂ¢Ã¢â€šÂ¬Ã…Â¡Ãƒâ€šÃ‚Â¬ÃƒÆ’Ã¢â‚¬Â¦Ãƒâ€šÃ‚Â¡ÃƒÆ’Ã†â€™Ãƒâ€ Ã¢â‚¬â„¢ÃƒÆ’Ã‚Â¢ÃƒÂ¢Ã¢â‚¬Å¡Ã‚Â¬Ãƒâ€¦Ã‚Â¡ÃƒÆ’Ã†â€™ÃƒÂ¢Ã¢â€šÂ¬Ã…Â¡ÃƒÆ’Ã¢â‚¬Å¡Ãƒâ€šÃ‚Â°C in both systems.</w:t>
       </w:r>
     </w:p>
     <w:p>
@@ -6931,7 +7018,7 @@
               <w:rPr>
                 <w:rFonts w:ascii="Times New Roman" w:hAnsi="Times New Roman" w:cs="Times New Roman"/>
               </w:rPr>
-              <w:t>pH (Mean ÃƒÆ’Ã†â€™ÃƒÂ¢Ã¢â€šÂ¬Ã…Â¡ÃƒÆ’Ã¢â‚¬Å¡Ãƒâ€šÃ‚Â± SD)</w:t>
+              <w:t>pH (Mean ÃƒÆ’Ã†â€™Ãƒâ€ Ã¢â‚¬â„¢ÃƒÆ’Ã¢â‚¬Â ÃƒÂ¢Ã¢â€šÂ¬Ã¢â€žÂ¢ÃƒÆ’Ã†â€™Ãƒâ€šÃ‚Â¢ÃƒÆ’Ã‚Â¢ÃƒÂ¢Ã¢â€šÂ¬Ã…Â¡Ãƒâ€šÃ‚Â¬ÃƒÆ’Ã¢â‚¬Â¦Ãƒâ€šÃ‚Â¡ÃƒÆ’Ã†â€™Ãƒâ€ Ã¢â‚¬â„¢ÃƒÆ’Ã‚Â¢ÃƒÂ¢Ã¢â‚¬Å¡Ã‚Â¬Ãƒâ€¦Ã‚Â¡ÃƒÆ’Ã†â€™ÃƒÂ¢Ã¢â€šÂ¬Ã…Â¡ÃƒÆ’Ã¢â‚¬Å¡Ãƒâ€šÃ‚Â± SD)</w:t>
             </w:r>
           </w:p>
         </w:tc>
@@ -6988,7 +7075,7 @@
               <w:rPr>
                 <w:rFonts w:ascii="Times New Roman" w:hAnsi="Times New Roman" w:cs="Times New Roman"/>
               </w:rPr>
-              <w:t>Temperature (ÃƒÆ’Ã†â€™ÃƒÂ¢Ã¢â€šÂ¬Ã…Â¡ÃƒÆ’Ã¢â‚¬Å¡Ãƒâ€šÃ‚Â°C)</w:t>
+              <w:t>Temperature (ÃƒÆ’Ã†â€™Ãƒâ€ Ã¢â‚¬â„¢ÃƒÆ’Ã¢â‚¬Â ÃƒÂ¢Ã¢â€šÂ¬Ã¢â€žÂ¢ÃƒÆ’Ã†â€™Ãƒâ€šÃ‚Â¢ÃƒÆ’Ã‚Â¢ÃƒÂ¢Ã¢â€šÂ¬Ã…Â¡Ãƒâ€šÃ‚Â¬ÃƒÆ’Ã¢â‚¬Â¦Ãƒâ€šÃ‚Â¡ÃƒÆ’Ã†â€™Ãƒâ€ Ã¢â‚¬â„¢ÃƒÆ’Ã‚Â¢ÃƒÂ¢Ã¢â‚¬Å¡Ã‚Â¬Ãƒâ€¦Ã‚Â¡ÃƒÆ’Ã†â€™ÃƒÂ¢Ã¢â€šÂ¬Ã…Â¡ÃƒÆ’Ã¢â‚¬Å¡Ãƒâ€šÃ‚Â°C)</w:t>
             </w:r>
           </w:p>
         </w:tc>
@@ -7929,7 +8016,7 @@
         <w:rPr>
           <w:rFonts w:ascii="Times New Roman" w:hAnsi="Times New Roman" w:cs="Times New Roman"/>
         </w:rPr>
-        <w:t>-chemical water quality parameters for IMTA (Integrated Multi-Trophic Aquaculture) and Monoculture treatments over a seven-week experimental period. Overall, both systems exhibited similar temporal patterns in temperature and pH, indicating that basic physical parameters followed the same environmental fluctuations in both treatments. Water temperature in both systems showed a declining trend from approximately 28ÃƒÆ’Ã†â€™ÃƒÂ¢Ã¢â€šÂ¬Ã…Â¡ÃƒÆ’Ã¢â‚¬Å¡Ãƒâ€šÃ‚Â°C at the beginning to a minimum of around 25.6ÃƒÆ’Ã†â€™Ãƒâ€šÃ‚Â¢ÃƒÆ’Ã‚Â¢ÃƒÂ¢Ã¢â€šÂ¬Ã…Â¡Ãƒâ€šÃ‚Â¬ÃƒÆ’Ã‚Â¢ÃƒÂ¢Ã¢â‚¬Å¡Ã‚Â¬Ãƒâ€¦Ã¢â‚¬Å“25.9ÃƒÆ’Ã†â€™ÃƒÂ¢Ã¢â€šÂ¬Ã…Â¡ÃƒÆ’Ã¢â‚¬Å¡Ãƒâ€šÃ‚Â°C in Week 4, before recovering and stabilizing at about 28.1ÃƒÆ’Ã†â€™ÃƒÂ¢Ã¢â€šÂ¬Ã…Â¡ÃƒÆ’Ã¢â‚¬Å¡Ãƒâ€šÃ‚Â°C by Week 7. Similarly, pH remained consistently alkaline throughout the study, with both treatments peaking in Week 4 (IMTA: 8.35; Monoculture: 8.37) and then gradually declining and stabilizing. From Week 3 onward, the IMTA system generally maintained slightly lower pH values compared to the Monoculture system.</w:t>
+        <w:t>-chemical water quality parameters for IMTA (Integrated Multi-Trophic Aquaculture) and Monoculture treatments over a seven-week experimental period. Overall, both systems exhibited similar temporal patterns in temperature and pH, indicating that basic physical parameters followed the same environmental fluctuations in both treatments. Water temperature in both systems showed a declining trend from approximately 28ÃƒÆ’Ã†â€™Ãƒâ€ Ã¢â‚¬â„¢ÃƒÆ’Ã¢â‚¬Â ÃƒÂ¢Ã¢â€šÂ¬Ã¢â€žÂ¢ÃƒÆ’Ã†â€™Ãƒâ€šÃ‚Â¢ÃƒÆ’Ã‚Â¢ÃƒÂ¢Ã¢â€šÂ¬Ã…Â¡Ãƒâ€šÃ‚Â¬ÃƒÆ’Ã¢â‚¬Â¦Ãƒâ€šÃ‚Â¡ÃƒÆ’Ã†â€™Ãƒâ€ Ã¢â‚¬â„¢ÃƒÆ’Ã‚Â¢ÃƒÂ¢Ã¢â‚¬Å¡Ã‚Â¬Ãƒâ€¦Ã‚Â¡ÃƒÆ’Ã†â€™ÃƒÂ¢Ã¢â€šÂ¬Ã…Â¡ÃƒÆ’Ã¢â‚¬Å¡Ãƒâ€šÃ‚Â°C at the beginning to a minimum of around 25.6ÃƒÆ’Ã†â€™Ãƒâ€ Ã¢â‚¬â„¢ÃƒÆ’Ã¢â‚¬Â ÃƒÂ¢Ã¢â€šÂ¬Ã¢â€žÂ¢ÃƒÆ’Ã†â€™ÃƒÂ¢Ã¢â€šÂ¬Ã…Â¡ÃƒÆ’Ã¢â‚¬Å¡Ãƒâ€šÃ‚Â¢ÃƒÆ’Ã†â€™Ãƒâ€ Ã¢â‚¬â„¢ÃƒÆ’Ã¢â‚¬Å¡Ãƒâ€šÃ‚Â¢ÃƒÆ’Ã†â€™Ãƒâ€šÃ‚Â¢ÃƒÆ’Ã‚Â¢ÃƒÂ¢Ã¢â€šÂ¬Ã…Â¡Ãƒâ€šÃ‚Â¬ÃƒÆ’Ã¢â‚¬Â¦Ãƒâ€šÃ‚Â¡ÃƒÆ’Ã†â€™ÃƒÂ¢Ã¢â€šÂ¬Ã…Â¡ÃƒÆ’Ã¢â‚¬Å¡Ãƒâ€šÃ‚Â¬ÃƒÆ’Ã†â€™Ãƒâ€ Ã¢â‚¬â„¢ÃƒÆ’Ã¢â‚¬Å¡Ãƒâ€šÃ‚Â¢ÃƒÆ’Ã†â€™Ãƒâ€šÃ‚Â¢ÃƒÆ’Ã‚Â¢ÃƒÂ¢Ã¢â‚¬Å¡Ã‚Â¬Ãƒâ€¦Ã‚Â¡ÃƒÆ’Ã¢â‚¬Å¡Ãƒâ€šÃ‚Â¬ÃƒÆ’Ã†â€™ÃƒÂ¢Ã¢â€šÂ¬Ã‚Â¦ÃƒÆ’Ã‚Â¢ÃƒÂ¢Ã¢â‚¬Å¡Ã‚Â¬Ãƒâ€¦Ã¢â‚¬Å“25.9ÃƒÆ’Ã†â€™Ãƒâ€ Ã¢â‚¬â„¢ÃƒÆ’Ã¢â‚¬Â ÃƒÂ¢Ã¢â€šÂ¬Ã¢â€žÂ¢ÃƒÆ’Ã†â€™Ãƒâ€šÃ‚Â¢ÃƒÆ’Ã‚Â¢ÃƒÂ¢Ã¢â€šÂ¬Ã…Â¡Ãƒâ€šÃ‚Â¬ÃƒÆ’Ã¢â‚¬Â¦Ãƒâ€šÃ‚Â¡ÃƒÆ’Ã†â€™Ãƒâ€ Ã¢â‚¬â„¢ÃƒÆ’Ã‚Â¢ÃƒÂ¢Ã¢â‚¬Å¡Ã‚Â¬Ãƒâ€¦Ã‚Â¡ÃƒÆ’Ã†â€™ÃƒÂ¢Ã¢â€šÂ¬Ã…Â¡ÃƒÆ’Ã¢â‚¬Å¡Ãƒâ€šÃ‚Â°C in Week 4, before recovering and stabilizing at about 28.1ÃƒÆ’Ã†â€™Ãƒâ€ Ã¢â‚¬â„¢ÃƒÆ’Ã¢â‚¬Â ÃƒÂ¢Ã¢â€šÂ¬Ã¢â€žÂ¢ÃƒÆ’Ã†â€™Ãƒâ€šÃ‚Â¢ÃƒÆ’Ã‚Â¢ÃƒÂ¢Ã¢â€šÂ¬Ã…Â¡Ãƒâ€šÃ‚Â¬ÃƒÆ’Ã¢â‚¬Â¦Ãƒâ€šÃ‚Â¡ÃƒÆ’Ã†â€™Ãƒâ€ Ã¢â‚¬â„¢ÃƒÆ’Ã‚Â¢ÃƒÂ¢Ã¢â‚¬Å¡Ã‚Â¬Ãƒâ€¦Ã‚Â¡ÃƒÆ’Ã†â€™ÃƒÂ¢Ã¢â€šÂ¬Ã…Â¡ÃƒÆ’Ã¢â‚¬Å¡Ãƒâ€šÃ‚Â°C by Week 7. Similarly, pH remained consistently alkaline throughout the study, with both treatments peaking in Week 4 (IMTA: 8.35; Monoculture: 8.37) and then gradually declining and stabilizing. From Week 3 onward, the IMTA system generally maintained slightly lower pH values compared to the Monoculture system.</w:t>
       </w:r>
     </w:p>
     <w:p>
@@ -8171,7 +8258,7 @@
           <w:sz w:val="28"/>
           <w:szCs w:val="28"/>
         </w:rPr>
-        <w:t>ÃƒÆ’Ã†â€™Ãƒâ€¦Ã‚Â½ÃƒÆ’Ã¢â‚¬Å¡Ãƒâ€šÃ‚Â¼g</w:t>
+        <w:t>ÃƒÆ’Ã†â€™Ãƒâ€ Ã¢â‚¬â„¢ÃƒÆ’Ã¢â‚¬Â ÃƒÂ¢Ã¢â€šÂ¬Ã¢â€žÂ¢ÃƒÆ’Ã†â€™ÃƒÂ¢Ã¢â€šÂ¬Ã‚Â¦ÃƒÆ’Ã¢â‚¬Å¡Ãƒâ€šÃ‚Â½ÃƒÆ’Ã†â€™Ãƒâ€ Ã¢â‚¬â„¢ÃƒÆ’Ã‚Â¢ÃƒÂ¢Ã¢â‚¬Å¡Ã‚Â¬Ãƒâ€¦Ã‚Â¡ÃƒÆ’Ã†â€™ÃƒÂ¢Ã¢â€šÂ¬Ã…Â¡ÃƒÆ’Ã¢â‚¬Å¡Ãƒâ€šÃ‚Â¼g</w:t>
       </w:r>
       <w:proofErr w:type="spellEnd"/>
       <w:r>
@@ -8189,7 +8276,7 @@
           <w:sz w:val="28"/>
           <w:szCs w:val="28"/>
         </w:rPr>
-        <w:t>ÃƒÆ’Ã†â€™Ãƒâ€¦Ã‚Â½ÃƒÆ’Ã¢â‚¬Å¡Ãƒâ€šÃ‚Â¼g</w:t>
+        <w:t>ÃƒÆ’Ã†â€™Ãƒâ€ Ã¢â‚¬â„¢ÃƒÆ’Ã¢â‚¬Â ÃƒÂ¢Ã¢â€šÂ¬Ã¢â€žÂ¢ÃƒÆ’Ã†â€™ÃƒÂ¢Ã¢â€šÂ¬Ã‚Â¦ÃƒÆ’Ã¢â‚¬Å¡Ãƒâ€šÃ‚Â½ÃƒÆ’Ã†â€™Ãƒâ€ Ã¢â‚¬â„¢ÃƒÆ’Ã‚Â¢ÃƒÂ¢Ã¢â‚¬Å¡Ã‚Â¬Ãƒâ€¦Ã‚Â¡ÃƒÆ’Ã†â€™ÃƒÂ¢Ã¢â€šÂ¬Ã…Â¡ÃƒÆ’Ã¢â‚¬Å¡Ãƒâ€šÃ‚Â¼g</w:t>
       </w:r>
       <w:proofErr w:type="spellEnd"/>
       <w:r>
@@ -8319,7 +8406,7 @@
           <w:szCs w:val="28"/>
         </w:rPr>
         <w:lastRenderedPageBreak/>
-        <w:t xml:space="preserve">By Week 7, sodium nitrite concentrations in both treatments had declined and stabilized at very similar levels, approximately 73ÃƒÆ’Ã†â€™Ãƒâ€šÃ‚Â¢ÃƒÆ’Ã‚Â¢ÃƒÂ¢Ã¢â€šÂ¬Ã…Â¡Ãƒâ€šÃ‚Â¬ÃƒÆ’Ã‚Â¢ÃƒÂ¢Ã¢â‚¬Å¡Ã‚Â¬Ãƒâ€¦Ã¢â‚¬Å“74 </w:t>
+        <w:t xml:space="preserve">By Week 7, sodium nitrite concentrations in both treatments had declined and stabilized at very similar levels, approximately 73ÃƒÆ’Ã†â€™Ãƒâ€ Ã¢â‚¬â„¢ÃƒÆ’Ã¢â‚¬Â ÃƒÂ¢Ã¢â€šÂ¬Ã¢â€žÂ¢ÃƒÆ’Ã†â€™ÃƒÂ¢Ã¢â€šÂ¬Ã…Â¡ÃƒÆ’Ã¢â‚¬Å¡Ãƒâ€šÃ‚Â¢ÃƒÆ’Ã†â€™Ãƒâ€ Ã¢â‚¬â„¢ÃƒÆ’Ã¢â‚¬Å¡Ãƒâ€šÃ‚Â¢ÃƒÆ’Ã†â€™Ãƒâ€šÃ‚Â¢ÃƒÆ’Ã‚Â¢ÃƒÂ¢Ã¢â€šÂ¬Ã…Â¡Ãƒâ€šÃ‚Â¬ÃƒÆ’Ã¢â‚¬Â¦Ãƒâ€šÃ‚Â¡ÃƒÆ’Ã†â€™ÃƒÂ¢Ã¢â€šÂ¬Ã…Â¡ÃƒÆ’Ã¢â‚¬Å¡Ãƒâ€šÃ‚Â¬ÃƒÆ’Ã†â€™Ãƒâ€ Ã¢â‚¬â„¢ÃƒÆ’Ã¢â‚¬Å¡Ãƒâ€šÃ‚Â¢ÃƒÆ’Ã†â€™Ãƒâ€šÃ‚Â¢ÃƒÆ’Ã‚Â¢ÃƒÂ¢Ã¢â‚¬Å¡Ã‚Â¬Ãƒâ€¦Ã‚Â¡ÃƒÆ’Ã¢â‚¬Å¡Ãƒâ€šÃ‚Â¬ÃƒÆ’Ã†â€™ÃƒÂ¢Ã¢â€šÂ¬Ã‚Â¦ÃƒÆ’Ã‚Â¢ÃƒÂ¢Ã¢â‚¬Å¡Ã‚Â¬Ãƒâ€¦Ã¢â‚¬Å“74 </w:t>
       </w:r>
       <w:proofErr w:type="spellStart"/>
       <w:r>
@@ -8328,7 +8415,7 @@
           <w:sz w:val="28"/>
           <w:szCs w:val="28"/>
         </w:rPr>
-        <w:t>ÃƒÆ’Ã†â€™Ãƒâ€¦Ã‚Â½ÃƒÆ’Ã¢â‚¬Å¡Ãƒâ€šÃ‚Â¼g</w:t>
+        <w:t>ÃƒÆ’Ã†â€™Ãƒâ€ Ã¢â‚¬â„¢ÃƒÆ’Ã¢â‚¬Â ÃƒÂ¢Ã¢â€šÂ¬Ã¢â€žÂ¢ÃƒÆ’Ã†â€™ÃƒÂ¢Ã¢â€šÂ¬Ã‚Â¦ÃƒÆ’Ã¢â‚¬Å¡Ãƒâ€šÃ‚Â½ÃƒÆ’Ã†â€™Ãƒâ€ Ã¢â‚¬â„¢ÃƒÆ’Ã‚Â¢ÃƒÂ¢Ã¢â‚¬Å¡Ã‚Â¬Ãƒâ€¦Ã‚Â¡ÃƒÆ’Ã†â€™ÃƒÂ¢Ã¢â€šÂ¬Ã…Â¡ÃƒÆ’Ã¢â‚¬Å¡Ãƒâ€šÃ‚Â¼g</w:t>
       </w:r>
       <w:proofErr w:type="spellEnd"/>
       <w:r>
@@ -8464,7 +8551,7 @@
           <w:szCs w:val="28"/>
         </w:rPr>
         <w:lastRenderedPageBreak/>
-        <w:t>The bar chart illustrates the changes in nitrite nitrogen (NOÃƒÆ’Ã†â€™Ãƒâ€šÃ‚Â¢ÃƒÆ’Ã‚Â¢ÃƒÂ¢Ã¢â‚¬Å¡Ã‚Â¬Ãƒâ€¦Ã‚Â¡ÃƒÆ’Ã‚Â¢ÃƒÂ¢Ã¢â‚¬Å¡Ã‚Â¬Ãƒâ€¦Ã‚Â¡ÃƒÆ’Ã†â€™Ãƒâ€šÃ‚Â¢ÃƒÆ’Ã¢â‚¬Å¡Ãƒâ€šÃ‚ÂÃƒÆ’Ã¢â‚¬Å¡Ãƒâ€šÃ‚Â»-N) concentration (</w:t>
+        <w:t>The bar chart illustrates the changes in nitrite nitrogen (NOÃƒÆ’Ã†â€™Ãƒâ€ Ã¢â‚¬â„¢ÃƒÆ’Ã¢â‚¬Â ÃƒÂ¢Ã¢â€šÂ¬Ã¢â€žÂ¢ÃƒÆ’Ã†â€™ÃƒÂ¢Ã¢â€šÂ¬Ã…Â¡ÃƒÆ’Ã¢â‚¬Å¡Ãƒâ€šÃ‚Â¢ÃƒÆ’Ã†â€™Ãƒâ€ Ã¢â‚¬â„¢ÃƒÆ’Ã¢â‚¬Å¡Ãƒâ€šÃ‚Â¢ÃƒÆ’Ã†â€™Ãƒâ€šÃ‚Â¢ÃƒÆ’Ã‚Â¢ÃƒÂ¢Ã¢â‚¬Å¡Ã‚Â¬Ãƒâ€¦Ã‚Â¡ÃƒÆ’Ã¢â‚¬Å¡Ãƒâ€šÃ‚Â¬ÃƒÆ’Ã†â€™ÃƒÂ¢Ã¢â€šÂ¬Ã‚Â¦ÃƒÆ’Ã¢â‚¬Å¡Ãƒâ€šÃ‚Â¡ÃƒÆ’Ã†â€™Ãƒâ€ Ã¢â‚¬â„¢ÃƒÆ’Ã¢â‚¬Å¡Ãƒâ€šÃ‚Â¢ÃƒÆ’Ã†â€™Ãƒâ€šÃ‚Â¢ÃƒÆ’Ã‚Â¢ÃƒÂ¢Ã¢â‚¬Å¡Ã‚Â¬Ãƒâ€¦Ã‚Â¡ÃƒÆ’Ã¢â‚¬Å¡Ãƒâ€šÃ‚Â¬ÃƒÆ’Ã†â€™ÃƒÂ¢Ã¢â€šÂ¬Ã‚Â¦ÃƒÆ’Ã¢â‚¬Å¡Ãƒâ€šÃ‚Â¡ÃƒÆ’Ã†â€™Ãƒâ€ Ã¢â‚¬â„¢ÃƒÆ’Ã¢â‚¬Â ÃƒÂ¢Ã¢â€šÂ¬Ã¢â€žÂ¢ÃƒÆ’Ã†â€™ÃƒÂ¢Ã¢â€šÂ¬Ã…Â¡ÃƒÆ’Ã¢â‚¬Å¡Ãƒâ€šÃ‚Â¢ÃƒÆ’Ã†â€™Ãƒâ€ Ã¢â‚¬â„¢ÃƒÆ’Ã‚Â¢ÃƒÂ¢Ã¢â‚¬Å¡Ã‚Â¬Ãƒâ€¦Ã‚Â¡ÃƒÆ’Ã†â€™ÃƒÂ¢Ã¢â€šÂ¬Ã…Â¡ÃƒÆ’Ã¢â‚¬Å¡Ãƒâ€šÃ‚ÂÃƒÆ’Ã†â€™Ãƒâ€ Ã¢â‚¬â„¢ÃƒÆ’Ã‚Â¢ÃƒÂ¢Ã¢â‚¬Å¡Ã‚Â¬Ãƒâ€¦Ã‚Â¡ÃƒÆ’Ã†â€™ÃƒÂ¢Ã¢â€šÂ¬Ã…Â¡ÃƒÆ’Ã¢â‚¬Å¡Ãƒâ€šÃ‚Â»-N) concentration (</w:t>
       </w:r>
       <w:proofErr w:type="spellStart"/>
       <w:r>
@@ -8473,7 +8560,7 @@
           <w:sz w:val="28"/>
           <w:szCs w:val="28"/>
         </w:rPr>
-        <w:t>ÃƒÆ’Ã†â€™Ãƒâ€¦Ã‚Â½ÃƒÆ’Ã¢â‚¬Å¡Ãƒâ€šÃ‚Â¼g</w:t>
+        <w:t>ÃƒÆ’Ã†â€™Ãƒâ€ Ã¢â‚¬â„¢ÃƒÆ’Ã¢â‚¬Â ÃƒÂ¢Ã¢â€šÂ¬Ã¢â€žÂ¢ÃƒÆ’Ã†â€™ÃƒÂ¢Ã¢â€šÂ¬Ã‚Â¦ÃƒÆ’Ã¢â‚¬Å¡Ãƒâ€šÃ‚Â½ÃƒÆ’Ã†â€™Ãƒâ€ Ã¢â‚¬â„¢ÃƒÆ’Ã‚Â¢ÃƒÂ¢Ã¢â‚¬Å¡Ã‚Â¬Ãƒâ€¦Ã‚Â¡ÃƒÆ’Ã†â€™ÃƒÂ¢Ã¢â€šÂ¬Ã…Â¡ÃƒÆ’Ã¢â‚¬Å¡Ãƒâ€šÃ‚Â¼g</w:t>
       </w:r>
       <w:proofErr w:type="spellEnd"/>
       <w:r>
@@ -8491,7 +8578,7 @@
           <w:sz w:val="28"/>
           <w:szCs w:val="28"/>
         </w:rPr>
-        <w:t>ÃƒÆ’Ã†â€™Ãƒâ€¦Ã‚Â½ÃƒÆ’Ã¢â‚¬Å¡Ãƒâ€šÃ‚Â¼g</w:t>
+        <w:t>ÃƒÆ’Ã†â€™Ãƒâ€ Ã¢â‚¬â„¢ÃƒÆ’Ã¢â‚¬Â ÃƒÂ¢Ã¢â€šÂ¬Ã¢â€žÂ¢ÃƒÆ’Ã†â€™ÃƒÂ¢Ã¢â€šÂ¬Ã‚Â¦ÃƒÆ’Ã¢â‚¬Å¡Ãƒâ€šÃ‚Â½ÃƒÆ’Ã†â€™Ãƒâ€ Ã¢â‚¬â„¢ÃƒÆ’Ã‚Â¢ÃƒÂ¢Ã¢â‚¬Å¡Ã‚Â¬Ãƒâ€¦Ã‚Â¡ÃƒÆ’Ã†â€™ÃƒÂ¢Ã¢â€šÂ¬Ã…Â¡ÃƒÆ’Ã¢â‚¬Å¡Ãƒâ€šÃ‚Â¼g</w:t>
       </w:r>
       <w:proofErr w:type="spellEnd"/>
       <w:r>
@@ -8509,7 +8596,7 @@
           <w:sz w:val="28"/>
           <w:szCs w:val="28"/>
         </w:rPr>
-        <w:t>ÃƒÆ’Ã†â€™Ãƒâ€¦Ã‚Â½ÃƒÆ’Ã¢â‚¬Å¡Ãƒâ€šÃ‚Â¼g</w:t>
+        <w:t>ÃƒÆ’Ã†â€™Ãƒâ€ Ã¢â‚¬â„¢ÃƒÆ’Ã¢â‚¬Â ÃƒÂ¢Ã¢â€šÂ¬Ã¢â€žÂ¢ÃƒÆ’Ã†â€™ÃƒÂ¢Ã¢â€šÂ¬Ã‚Â¦ÃƒÆ’Ã¢â‚¬Å¡Ãƒâ€šÃ‚Â½ÃƒÆ’Ã†â€™Ãƒâ€ Ã¢â‚¬â„¢ÃƒÆ’Ã‚Â¢ÃƒÂ¢Ã¢â‚¬Å¡Ã‚Â¬Ãƒâ€¦Ã‚Â¡ÃƒÆ’Ã†â€™ÃƒÂ¢Ã¢â€šÂ¬Ã…Â¡ÃƒÆ’Ã¢â‚¬Å¡Ãƒâ€šÃ‚Â¼g</w:t>
       </w:r>
       <w:proofErr w:type="spellEnd"/>
       <w:r>
@@ -8545,7 +8632,7 @@
           <w:sz w:val="28"/>
           <w:szCs w:val="28"/>
         </w:rPr>
-        <w:t>ÃƒÆ’Ã†â€™Ãƒâ€¦Ã‚Â½ÃƒÆ’Ã¢â‚¬Å¡Ãƒâ€šÃ‚Â¼g</w:t>
+        <w:t>ÃƒÆ’Ã†â€™Ãƒâ€ Ã¢â‚¬â„¢ÃƒÆ’Ã¢â‚¬Â ÃƒÂ¢Ã¢â€šÂ¬Ã¢â€žÂ¢ÃƒÆ’Ã†â€™ÃƒÂ¢Ã¢â€šÂ¬Ã‚Â¦ÃƒÆ’Ã¢â‚¬Å¡Ãƒâ€šÃ‚Â½ÃƒÆ’Ã†â€™Ãƒâ€ Ã¢â‚¬â„¢ÃƒÆ’Ã‚Â¢ÃƒÂ¢Ã¢â‚¬Å¡Ã‚Â¬Ãƒâ€¦Ã‚Â¡ÃƒÆ’Ã†â€™ÃƒÂ¢Ã¢â€šÂ¬Ã…Â¡ÃƒÆ’Ã¢â‚¬Å¡Ãƒâ€šÃ‚Â¼g</w:t>
       </w:r>
       <w:proofErr w:type="spellEnd"/>
       <w:r>
@@ -8800,7 +8887,7 @@
           <w:sz w:val="28"/>
           <w:szCs w:val="28"/>
         </w:rPr>
-        <w:t>The bar chart illustrates the changes in phosphate (POÃƒÆ’Ã†â€™Ãƒâ€šÃ‚Â¢ÃƒÆ’Ã‚Â¢ÃƒÂ¢Ã¢â‚¬Å¡Ã‚Â¬Ãƒâ€¦Ã‚Â¡ÃƒÆ’Ã‚Â¢ÃƒÂ¢Ã¢â‚¬Å¡Ã‚Â¬Ãƒâ€¦Ã‚Â¾ÃƒÆ’Ã†â€™ÃƒÂ¢Ã¢â€šÂ¬Ã…Â¡ÃƒÆ’Ã¢â‚¬Å¡Ãƒâ€šÃ‚Â³ÃƒÆ’Ã†â€™Ãƒâ€šÃ‚Â¢ÃƒÆ’Ã¢â‚¬Å¡Ãƒâ€šÃ‚ÂÃƒÆ’Ã¢â‚¬Å¡Ãƒâ€šÃ‚Â») concentration (</w:t>
+        <w:t>The bar chart illustrates the changes in phosphate (POÃƒÆ’Ã†â€™Ãƒâ€ Ã¢â‚¬â„¢ÃƒÆ’Ã¢â‚¬Â ÃƒÂ¢Ã¢â€šÂ¬Ã¢â€žÂ¢ÃƒÆ’Ã†â€™ÃƒÂ¢Ã¢â€šÂ¬Ã…Â¡ÃƒÆ’Ã¢â‚¬Å¡Ãƒâ€šÃ‚Â¢ÃƒÆ’Ã†â€™Ãƒâ€ Ã¢â‚¬â„¢ÃƒÆ’Ã¢â‚¬Å¡Ãƒâ€šÃ‚Â¢ÃƒÆ’Ã†â€™Ãƒâ€šÃ‚Â¢ÃƒÆ’Ã‚Â¢ÃƒÂ¢Ã¢â‚¬Å¡Ã‚Â¬Ãƒâ€¦Ã‚Â¡ÃƒÆ’Ã¢â‚¬Å¡Ãƒâ€šÃ‚Â¬ÃƒÆ’Ã†â€™ÃƒÂ¢Ã¢â€šÂ¬Ã‚Â¦ÃƒÆ’Ã¢â‚¬Å¡Ãƒâ€šÃ‚Â¡ÃƒÆ’Ã†â€™Ãƒâ€ Ã¢â‚¬â„¢ÃƒÆ’Ã¢â‚¬Å¡Ãƒâ€šÃ‚Â¢ÃƒÆ’Ã†â€™Ãƒâ€šÃ‚Â¢ÃƒÆ’Ã‚Â¢ÃƒÂ¢Ã¢â‚¬Å¡Ã‚Â¬Ãƒâ€¦Ã‚Â¡ÃƒÆ’Ã¢â‚¬Å¡Ãƒâ€šÃ‚Â¬ÃƒÆ’Ã†â€™ÃƒÂ¢Ã¢â€šÂ¬Ã‚Â¦ÃƒÆ’Ã¢â‚¬Å¡Ãƒâ€šÃ‚Â¾ÃƒÆ’Ã†â€™Ãƒâ€ Ã¢â‚¬â„¢ÃƒÆ’Ã¢â‚¬Â ÃƒÂ¢Ã¢â€šÂ¬Ã¢â€žÂ¢ÃƒÆ’Ã†â€™Ãƒâ€šÃ‚Â¢ÃƒÆ’Ã‚Â¢ÃƒÂ¢Ã¢â€šÂ¬Ã…Â¡Ãƒâ€šÃ‚Â¬ÃƒÆ’Ã¢â‚¬Â¦Ãƒâ€šÃ‚Â¡ÃƒÆ’Ã†â€™Ãƒâ€ Ã¢â‚¬â„¢ÃƒÆ’Ã‚Â¢ÃƒÂ¢Ã¢â‚¬Å¡Ã‚Â¬Ãƒâ€¦Ã‚Â¡ÃƒÆ’Ã†â€™ÃƒÂ¢Ã¢â€šÂ¬Ã…Â¡ÃƒÆ’Ã¢â‚¬Å¡Ãƒâ€šÃ‚Â³ÃƒÆ’Ã†â€™Ãƒâ€ Ã¢â‚¬â„¢ÃƒÆ’Ã¢â‚¬Â ÃƒÂ¢Ã¢â€šÂ¬Ã¢â€žÂ¢ÃƒÆ’Ã†â€™ÃƒÂ¢Ã¢â€šÂ¬Ã…Â¡ÃƒÆ’Ã¢â‚¬Å¡Ãƒâ€šÃ‚Â¢ÃƒÆ’Ã†â€™Ãƒâ€ Ã¢â‚¬â„¢ÃƒÆ’Ã‚Â¢ÃƒÂ¢Ã¢â‚¬Å¡Ã‚Â¬Ãƒâ€¦Ã‚Â¡ÃƒÆ’Ã†â€™ÃƒÂ¢Ã¢â€šÂ¬Ã…Â¡ÃƒÆ’Ã¢â‚¬Å¡Ãƒâ€šÃ‚ÂÃƒÆ’Ã†â€™Ãƒâ€ Ã¢â‚¬â„¢ÃƒÆ’Ã‚Â¢ÃƒÂ¢Ã¢â‚¬Å¡Ã‚Â¬Ãƒâ€¦Ã‚Â¡ÃƒÆ’Ã†â€™ÃƒÂ¢Ã¢â€šÂ¬Ã…Â¡ÃƒÆ’Ã¢â‚¬Å¡Ãƒâ€šÃ‚Â») concentration (</w:t>
       </w:r>
       <w:proofErr w:type="spellStart"/>
       <w:r>
@@ -8809,7 +8896,7 @@
           <w:sz w:val="28"/>
           <w:szCs w:val="28"/>
         </w:rPr>
-        <w:t>ÃƒÆ’Ã†â€™Ãƒâ€¦Ã‚Â½ÃƒÆ’Ã¢â‚¬Å¡Ãƒâ€šÃ‚Â¼g</w:t>
+        <w:t>ÃƒÆ’Ã†â€™Ãƒâ€ Ã¢â‚¬â„¢ÃƒÆ’Ã¢â‚¬Â ÃƒÂ¢Ã¢â€šÂ¬Ã¢â€žÂ¢ÃƒÆ’Ã†â€™ÃƒÂ¢Ã¢â€šÂ¬Ã‚Â¦ÃƒÆ’Ã¢â‚¬Å¡Ãƒâ€šÃ‚Â½ÃƒÆ’Ã†â€™Ãƒâ€ Ã¢â‚¬â„¢ÃƒÆ’Ã‚Â¢ÃƒÂ¢Ã¢â‚¬Å¡Ã‚Â¬Ãƒâ€¦Ã‚Â¡ÃƒÆ’Ã†â€™ÃƒÂ¢Ã¢â€šÂ¬Ã…Â¡ÃƒÆ’Ã¢â‚¬Å¡Ãƒâ€šÃ‚Â¼g</w:t>
       </w:r>
       <w:proofErr w:type="spellEnd"/>
       <w:r>
@@ -8827,7 +8914,7 @@
           <w:sz w:val="28"/>
           <w:szCs w:val="28"/>
         </w:rPr>
-        <w:t>ÃƒÆ’Ã†â€™Ãƒâ€¦Ã‚Â½ÃƒÆ’Ã¢â‚¬Å¡Ãƒâ€šÃ‚Â¼g</w:t>
+        <w:t>ÃƒÆ’Ã†â€™Ãƒâ€ Ã¢â‚¬â„¢ÃƒÆ’Ã¢â‚¬Â ÃƒÂ¢Ã¢â€šÂ¬Ã¢â€žÂ¢ÃƒÆ’Ã†â€™ÃƒÂ¢Ã¢â€šÂ¬Ã‚Â¦ÃƒÆ’Ã¢â‚¬Å¡Ãƒâ€šÃ‚Â½ÃƒÆ’Ã†â€™Ãƒâ€ Ã¢â‚¬â„¢ÃƒÆ’Ã‚Â¢ÃƒÂ¢Ã¢â‚¬Å¡Ã‚Â¬Ãƒâ€¦Ã‚Â¡ÃƒÆ’Ã†â€™ÃƒÂ¢Ã¢â€šÂ¬Ã…Â¡ÃƒÆ’Ã¢â‚¬Å¡Ãƒâ€šÃ‚Â¼g</w:t>
       </w:r>
       <w:proofErr w:type="spellEnd"/>
       <w:r>
@@ -8845,7 +8932,7 @@
           <w:sz w:val="28"/>
           <w:szCs w:val="28"/>
         </w:rPr>
-        <w:t>ÃƒÆ’Ã†â€™Ãƒâ€¦Ã‚Â½ÃƒÆ’Ã¢â‚¬Å¡Ãƒâ€šÃ‚Â¼g</w:t>
+        <w:t>ÃƒÆ’Ã†â€™Ãƒâ€ Ã¢â‚¬â„¢ÃƒÆ’Ã¢â‚¬Â ÃƒÂ¢Ã¢â€šÂ¬Ã¢â€žÂ¢ÃƒÆ’Ã†â€™ÃƒÂ¢Ã¢â€šÂ¬Ã‚Â¦ÃƒÆ’Ã¢â‚¬Å¡Ãƒâ€šÃ‚Â½ÃƒÆ’Ã†â€™Ãƒâ€ Ã¢â‚¬â„¢ÃƒÆ’Ã‚Â¢ÃƒÂ¢Ã¢â‚¬Å¡Ã‚Â¬Ãƒâ€¦Ã‚Â¡ÃƒÆ’Ã†â€™ÃƒÂ¢Ã¢â€šÂ¬Ã…Â¡ÃƒÆ’Ã¢â‚¬Å¡Ãƒâ€šÃ‚Â¼g</w:t>
       </w:r>
       <w:proofErr w:type="spellEnd"/>
       <w:r>
@@ -8872,7 +8959,7 @@
           <w:sz w:val="28"/>
           <w:szCs w:val="28"/>
         </w:rPr>
-        <w:t>ÃƒÆ’Ã†â€™Ãƒâ€¦Ã‚Â½ÃƒÆ’Ã¢â‚¬Å¡Ãƒâ€šÃ‚Â¼g</w:t>
+        <w:t>ÃƒÆ’Ã†â€™Ãƒâ€ Ã¢â‚¬â„¢ÃƒÆ’Ã¢â‚¬Â ÃƒÂ¢Ã¢â€šÂ¬Ã¢â€žÂ¢ÃƒÆ’Ã†â€™ÃƒÂ¢Ã¢â€šÂ¬Ã‚Â¦ÃƒÆ’Ã¢â‚¬Å¡Ãƒâ€šÃ‚Â½ÃƒÆ’Ã†â€™Ãƒâ€ Ã¢â‚¬â„¢ÃƒÆ’Ã‚Â¢ÃƒÂ¢Ã¢â‚¬Å¡Ã‚Â¬Ãƒâ€¦Ã‚Â¡ÃƒÆ’Ã†â€™ÃƒÂ¢Ã¢â€šÂ¬Ã…Â¡ÃƒÆ’Ã¢â‚¬Å¡Ãƒâ€šÃ‚Â¼g</w:t>
       </w:r>
       <w:proofErr w:type="spellEnd"/>
       <w:r>
@@ -8890,7 +8977,7 @@
           <w:sz w:val="28"/>
           <w:szCs w:val="28"/>
         </w:rPr>
-        <w:t>ÃƒÆ’Ã†â€™Ãƒâ€¦Ã‚Â½ÃƒÆ’Ã¢â‚¬Å¡Ãƒâ€šÃ‚Â¼g</w:t>
+        <w:t>ÃƒÆ’Ã†â€™Ãƒâ€ Ã¢â‚¬â„¢ÃƒÆ’Ã¢â‚¬Â ÃƒÂ¢Ã¢â€šÂ¬Ã¢â€žÂ¢ÃƒÆ’Ã†â€™ÃƒÂ¢Ã¢â€šÂ¬Ã‚Â¦ÃƒÆ’Ã¢â‚¬Å¡Ãƒâ€šÃ‚Â½ÃƒÆ’Ã†â€™Ãƒâ€ Ã¢â‚¬â„¢ÃƒÆ’Ã‚Â¢ÃƒÂ¢Ã¢â‚¬Å¡Ã‚Â¬Ãƒâ€¦Ã‚Â¡ÃƒÆ’Ã†â€™ÃƒÂ¢Ã¢â€šÂ¬Ã…Â¡ÃƒÆ’Ã¢â‚¬Å¡Ãƒâ€šÃ‚Â¼g</w:t>
       </w:r>
       <w:proofErr w:type="spellEnd"/>
       <w:r>
@@ -9047,7 +9134,7 @@
           <w:sz w:val="28"/>
           <w:szCs w:val="28"/>
         </w:rPr>
-        <w:t>ÃƒÆ’Ã†â€™Ãƒâ€¦Ã‚Â½ÃƒÆ’Ã¢â‚¬Å¡Ãƒâ€šÃ‚Â¼g</w:t>
+        <w:t>ÃƒÆ’Ã†â€™Ãƒâ€ Ã¢â‚¬â„¢ÃƒÆ’Ã¢â‚¬Â ÃƒÂ¢Ã¢â€šÂ¬Ã¢â€žÂ¢ÃƒÆ’Ã†â€™ÃƒÂ¢Ã¢â€šÂ¬Ã‚Â¦ÃƒÆ’Ã¢â‚¬Å¡Ãƒâ€šÃ‚Â½ÃƒÆ’Ã†â€™Ãƒâ€ Ã¢â‚¬â„¢ÃƒÆ’Ã‚Â¢ÃƒÂ¢Ã¢â‚¬Å¡Ã‚Â¬Ãƒâ€¦Ã‚Â¡ÃƒÆ’Ã†â€™ÃƒÂ¢Ã¢â€šÂ¬Ã…Â¡ÃƒÆ’Ã¢â‚¬Å¡Ãƒâ€šÃ‚Â¼g</w:t>
       </w:r>
       <w:proofErr w:type="spellEnd"/>
       <w:r>
@@ -9065,7 +9152,7 @@
           <w:sz w:val="28"/>
           <w:szCs w:val="28"/>
         </w:rPr>
-        <w:t>ÃƒÆ’Ã†â€™Ãƒâ€¦Ã‚Â½ÃƒÆ’Ã¢â‚¬Å¡Ãƒâ€šÃ‚Â¼g</w:t>
+        <w:t>ÃƒÆ’Ã†â€™Ãƒâ€ Ã¢â‚¬â„¢ÃƒÆ’Ã¢â‚¬Â ÃƒÂ¢Ã¢â€šÂ¬Ã¢â€žÂ¢ÃƒÆ’Ã†â€™ÃƒÂ¢Ã¢â€šÂ¬Ã‚Â¦ÃƒÆ’Ã¢â‚¬Å¡Ãƒâ€šÃ‚Â½ÃƒÆ’Ã†â€™Ãƒâ€ Ã¢â‚¬â„¢ÃƒÆ’Ã‚Â¢ÃƒÂ¢Ã¢â‚¬Å¡Ã‚Â¬Ãƒâ€¦Ã‚Â¡ÃƒÆ’Ã†â€™ÃƒÂ¢Ã¢â€šÂ¬Ã…Â¡ÃƒÆ’Ã¢â‚¬Å¡Ãƒâ€šÃ‚Â¼g</w:t>
       </w:r>
       <w:proofErr w:type="spellEnd"/>
       <w:r>
@@ -9083,7 +9170,7 @@
           <w:sz w:val="28"/>
           <w:szCs w:val="28"/>
         </w:rPr>
-        <w:t>ÃƒÆ’Ã†â€™Ãƒâ€¦Ã‚Â½ÃƒÆ’Ã¢â‚¬Å¡Ãƒâ€šÃ‚Â¼g</w:t>
+        <w:t>ÃƒÆ’Ã†â€™Ãƒâ€ Ã¢â‚¬â„¢ÃƒÆ’Ã¢â‚¬Â ÃƒÂ¢Ã¢â€šÂ¬Ã¢â€žÂ¢ÃƒÆ’Ã†â€™ÃƒÂ¢Ã¢â€šÂ¬Ã‚Â¦ÃƒÆ’Ã¢â‚¬Å¡Ãƒâ€šÃ‚Â½ÃƒÆ’Ã†â€™Ãƒâ€ Ã¢â‚¬â„¢ÃƒÆ’Ã‚Â¢ÃƒÂ¢Ã¢â‚¬Å¡Ã‚Â¬Ãƒâ€¦Ã‚Â¡ÃƒÆ’Ã†â€™ÃƒÂ¢Ã¢â€šÂ¬Ã…Â¡ÃƒÆ’Ã¢â‚¬Å¡Ãƒâ€šÃ‚Â¼g</w:t>
       </w:r>
       <w:proofErr w:type="spellEnd"/>
       <w:r>
@@ -9101,7 +9188,7 @@
           <w:sz w:val="28"/>
           <w:szCs w:val="28"/>
         </w:rPr>
-        <w:t>ÃƒÆ’Ã†â€™Ãƒâ€¦Ã‚Â½ÃƒÆ’Ã¢â‚¬Å¡Ãƒâ€šÃ‚Â¼g</w:t>
+        <w:t>ÃƒÆ’Ã†â€™Ãƒâ€ Ã¢â‚¬â„¢ÃƒÆ’Ã¢â‚¬Â ÃƒÂ¢Ã¢â€šÂ¬Ã¢â€žÂ¢ÃƒÆ’Ã†â€™ÃƒÂ¢Ã¢â€šÂ¬Ã‚Â¦ÃƒÆ’Ã¢â‚¬Å¡Ãƒâ€šÃ‚Â½ÃƒÆ’Ã†â€™Ãƒâ€ Ã¢â‚¬â„¢ÃƒÆ’Ã‚Â¢ÃƒÂ¢Ã¢â‚¬Å¡Ã‚Â¬Ãƒâ€¦Ã‚Â¡ÃƒÆ’Ã†â€™ÃƒÂ¢Ã¢â€šÂ¬Ã…Â¡ÃƒÆ’Ã¢â‚¬Å¡Ãƒâ€šÃ‚Â¼g</w:t>
       </w:r>
       <w:proofErr w:type="spellEnd"/>
       <w:r>
@@ -9119,7 +9206,7 @@
           <w:sz w:val="28"/>
           <w:szCs w:val="28"/>
         </w:rPr>
-        <w:t>ÃƒÆ’Ã†â€™Ãƒâ€¦Ã‚Â½ÃƒÆ’Ã¢â‚¬Å¡Ãƒâ€šÃ‚Â¼g</w:t>
+        <w:t>ÃƒÆ’Ã†â€™Ãƒâ€ Ã¢â‚¬â„¢ÃƒÆ’Ã¢â‚¬Â ÃƒÂ¢Ã¢â€šÂ¬Ã¢â€žÂ¢ÃƒÆ’Ã†â€™ÃƒÂ¢Ã¢â€šÂ¬Ã‚Â¦ÃƒÆ’Ã¢â‚¬Å¡Ãƒâ€šÃ‚Â½ÃƒÆ’Ã†â€™Ãƒâ€ Ã¢â‚¬â„¢ÃƒÆ’Ã‚Â¢ÃƒÂ¢Ã¢â‚¬Å¡Ã‚Â¬Ãƒâ€¦Ã‚Â¡ÃƒÆ’Ã†â€™ÃƒÂ¢Ã¢â€šÂ¬Ã…Â¡ÃƒÆ’Ã¢â‚¬Å¡Ãƒâ€šÃ‚Â¼g</w:t>
       </w:r>
       <w:proofErr w:type="spellEnd"/>
       <w:r>

</xml_diff>

<commit_message>
Replace sample photo with generated location map
</commit_message>
<xml_diff>
--- a/result.docx
+++ b/result.docx
@@ -20,7 +20,7 @@
     </w:p>
     <w:p>
       <w:r>
-        <w:t xml:space="preserve">The sample collection and culture study area was located along the coastal waters of the Jaffna Peninsula, Sri Lanka, associated with the Palk Strait near Velanai/Thurayoor, Jaffna. The map reference provided for the sampling site shows approximately 9Â°40'01.6"N, 80Â°01'52.9"E (9.6671Â°N, 80.0314Â°E). The broader study area is within the northern coastal region of Sri Lanka, approximately 79.50Â°E-81.25Â°E and 9.25Â°N-10.00Â°N.</w:t>
+        <w:t xml:space="preserve">The sample collection and culture study area was located along the coastal waters of the Jaffna Peninsula, Sri Lanka, associated with the Palk Strait near Velanai/Thurayoor, Jaffna. The specific sampling position is marked with a square in Figure M1 at approximately 9Â°40'01.6"N, 80Â°01'52.9"E (9.6671Â°N, 80.0314Â°E). The broader study area is within the northern coastal region of Sri Lanka, approximately 79.50Â°E-81.25Â°E and 9.25Â°N-10.00Â°N.</w:t>
       </w:r>
     </w:p>
     <w:p>
@@ -86,7 +86,7 @@
         <w:rPr>
           <w:b/>
         </w:rPr>
-        <w:t xml:space="preserve">Figure M1: Map reference showing the sample collection area near the Palk Strait, Jaffna Peninsula, Sri Lanka.</w:t>
+        <w:t xml:space="preserve">Figure M1: Code-generated study-area map. The square marks the sample collection location near the Palk Strait, Jaffna Peninsula, Sri Lanka.</w:t>
       </w:r>
     </w:p>
     <w:p>
@@ -1694,7 +1694,7 @@
           <w:b/>
           <w:bCs/>
         </w:rPr>
-        <w:t xml:space="preserve">Table 2: Descriptive Statistics and WelchÃƒÆ’Ã†â€™Ãƒâ€ Ã¢â‚¬â„¢ÃƒÆ’Ã¢â‚¬Â ÃƒÂ¢Ã¢â€šÂ¬Ã¢â€žÂ¢ÃƒÆ’Ã†â€™ÃƒÂ¢Ã¢â€šÂ¬Ã…Â¡ÃƒÆ’Ã¢â‚¬Å¡Ãƒâ€šÃ‚Â¢ÃƒÆ’Ã†â€™Ãƒâ€ Ã¢â‚¬â„¢ÃƒÆ’Ã¢â‚¬Å¡Ãƒâ€šÃ‚Â¢ÃƒÆ’Ã†â€™Ãƒâ€šÃ‚Â¢ÃƒÆ’Ã‚Â¢ÃƒÂ¢Ã¢â€šÂ¬Ã…Â¡Ãƒâ€šÃ‚Â¬ÃƒÆ’Ã¢â‚¬Â¦Ãƒâ€šÃ‚Â¡ÃƒÆ’Ã†â€™ÃƒÂ¢Ã¢â€šÂ¬Ã…Â¡ÃƒÆ’Ã¢â‚¬Å¡Ãƒâ€šÃ‚Â¬ÃƒÆ’Ã†â€™Ãƒâ€ Ã¢â‚¬â„¢ÃƒÆ’Ã¢â‚¬Å¡Ãƒâ€šÃ‚Â¢ÃƒÆ’Ã†â€™Ãƒâ€šÃ‚Â¢ÃƒÆ’Ã‚Â¢ÃƒÂ¢Ã¢â€šÂ¬Ã…Â¡Ãƒâ€šÃ‚Â¬ÃƒÆ’Ã¢â‚¬Â¦Ãƒâ€šÃ‚Â¾ÃƒÆ’Ã†â€™ÃƒÂ¢Ã¢â€šÂ¬Ã…Â¡ÃƒÆ’Ã¢â‚¬Å¡Ãƒâ€šÃ‚Â¢s t-test Results for </w:t>
+        <w:t xml:space="preserve">Table 2: Descriptive Statistics and WelchÃƒÆ’Ã†â€™Ãƒâ€ Ã¢â‚¬â„¢ÃƒÆ’Ã¢â‚¬Â ÃƒÂ¢Ã¢â€šÂ¬Ã¢â€žÂ¢ÃƒÆ’Ã†â€™ÃƒÂ¢Ã¢â€šÂ¬Ã‚Â ÃƒÆ’Ã‚Â¢ÃƒÂ¢Ã¢â‚¬Å¡Ã‚Â¬ÃƒÂ¢Ã¢â‚¬Å¾Ã‚Â¢ÃƒÆ’Ã†â€™Ãƒâ€ Ã¢â‚¬â„¢ÃƒÆ’Ã‚Â¢ÃƒÂ¢Ã¢â‚¬Å¡Ã‚Â¬Ãƒâ€¦Ã‚Â¡ÃƒÆ’Ã†â€™ÃƒÂ¢Ã¢â€šÂ¬Ã…Â¡ÃƒÆ’Ã¢â‚¬Å¡Ãƒâ€šÃ‚Â¢ÃƒÆ’Ã†â€™Ãƒâ€ Ã¢â‚¬â„¢ÃƒÆ’Ã¢â‚¬Â ÃƒÂ¢Ã¢â€šÂ¬Ã¢â€žÂ¢ÃƒÆ’Ã†â€™ÃƒÂ¢Ã¢â€šÂ¬Ã…Â¡ÃƒÆ’Ã¢â‚¬Å¡Ãƒâ€šÃ‚Â¢ÃƒÆ’Ã†â€™Ãƒâ€ Ã¢â‚¬â„¢ÃƒÆ’Ã¢â‚¬Å¡Ãƒâ€šÃ‚Â¢ÃƒÆ’Ã†â€™Ãƒâ€šÃ‚Â¢ÃƒÆ’Ã‚Â¢ÃƒÂ¢Ã¢â‚¬Å¡Ã‚Â¬Ãƒâ€¦Ã‚Â¡ÃƒÆ’Ã¢â‚¬Å¡Ãƒâ€šÃ‚Â¬ÃƒÆ’Ã†â€™ÃƒÂ¢Ã¢â€šÂ¬Ã‚Â¦ÃƒÆ’Ã¢â‚¬Å¡Ãƒâ€šÃ‚Â¡ÃƒÆ’Ã†â€™Ãƒâ€ Ã¢â‚¬â„¢ÃƒÆ’Ã‚Â¢ÃƒÂ¢Ã¢â‚¬Å¡Ã‚Â¬Ãƒâ€¦Ã‚Â¡ÃƒÆ’Ã†â€™ÃƒÂ¢Ã¢â€šÂ¬Ã…Â¡ÃƒÆ’Ã¢â‚¬Å¡Ãƒâ€šÃ‚Â¬ÃƒÆ’Ã†â€™Ãƒâ€ Ã¢â‚¬â„¢ÃƒÆ’Ã¢â‚¬Â ÃƒÂ¢Ã¢â€šÂ¬Ã¢â€žÂ¢ÃƒÆ’Ã†â€™ÃƒÂ¢Ã¢â€šÂ¬Ã…Â¡ÃƒÆ’Ã¢â‚¬Å¡Ãƒâ€šÃ‚Â¢ÃƒÆ’Ã†â€™Ãƒâ€ Ã¢â‚¬â„¢ÃƒÆ’Ã¢â‚¬Å¡Ãƒâ€šÃ‚Â¢ÃƒÆ’Ã†â€™Ãƒâ€šÃ‚Â¢ÃƒÆ’Ã‚Â¢ÃƒÂ¢Ã¢â‚¬Å¡Ã‚Â¬Ãƒâ€¦Ã‚Â¡ÃƒÆ’Ã¢â‚¬Å¡Ãƒâ€šÃ‚Â¬ÃƒÆ’Ã†â€™ÃƒÂ¢Ã¢â€šÂ¬Ã‚Â¦ÃƒÆ’Ã¢â‚¬Å¡Ãƒâ€šÃ‚Â¾ÃƒÆ’Ã†â€™Ãƒâ€ Ã¢â‚¬â„¢ÃƒÆ’Ã‚Â¢ÃƒÂ¢Ã¢â‚¬Å¡Ã‚Â¬Ãƒâ€¦Ã‚Â¡ÃƒÆ’Ã†â€™ÃƒÂ¢Ã¢â€šÂ¬Ã…Â¡ÃƒÆ’Ã¢â‚¬Å¡Ãƒâ€šÃ‚Â¢s t-test Results for </w:t>
       </w:r>
       <w:r>
         <w:rPr>
@@ -2351,21 +2351,21 @@
         <w:rPr>
           <w:rFonts w:ascii="Times New Roman" w:hAnsi="Times New Roman" w:cs="Times New Roman"/>
         </w:rPr>
-        <w:t xml:space="preserve"> in IMTA and Monoculture systems across four sampling intervals. Overall, both systems show fluctuating growth patterns, including periods of weight loss and recovery. In the early phase (Wk2ÃƒÆ’Ã†â€™Ãƒâ€ Ã¢â‚¬â„¢ÃƒÆ’Ã¢â‚¬Â ÃƒÂ¢Ã¢â€šÂ¬Ã¢â€žÂ¢ÃƒÆ’Ã†â€™ÃƒÂ¢Ã¢â€šÂ¬Ã…Â¡ÃƒÆ’Ã¢â‚¬Å¡Ãƒâ€šÃ‚Â¢ÃƒÆ’Ã†â€™Ãƒâ€ Ã¢â‚¬â„¢ÃƒÆ’Ã¢â‚¬Å¡Ãƒâ€šÃ‚Â¢ÃƒÆ’Ã†â€™Ãƒâ€šÃ‚Â¢ÃƒÆ’Ã‚Â¢ÃƒÂ¢Ã¢â€šÂ¬Ã…Â¡Ãƒâ€šÃ‚Â¬ÃƒÆ’Ã¢â‚¬Â¦Ãƒâ€šÃ‚Â¡ÃƒÆ’Ã†â€™ÃƒÂ¢Ã¢â€šÂ¬Ã…Â¡ÃƒÆ’Ã¢â‚¬Å¡Ãƒâ€šÃ‚Â¬ÃƒÆ’Ã†â€™Ãƒâ€ Ã¢â‚¬â„¢ÃƒÆ’Ã¢â‚¬Å¡Ãƒâ€šÃ‚Â¢ÃƒÆ’Ã†â€™Ãƒâ€šÃ‚Â¢ÃƒÆ’Ã‚Â¢ÃƒÂ¢Ã¢â‚¬Å¡Ã‚Â¬Ãƒâ€¦Ã‚Â¡ÃƒÆ’Ã¢â‚¬Å¡Ãƒâ€šÃ‚Â¬ÃƒÆ’Ã†â€™ÃƒÂ¢Ã¢â€šÂ¬Ã‚Â¦ÃƒÆ’Ã‚Â¢ÃƒÂ¢Ã¢â‚¬Å¡Ã‚Â¬Ãƒâ€¦Ã¢â‚¬Å“Wk3), both treatments recorded negative growth rates, with the IMTA system showing a sharper decline (-5.953 g/day) compared to the Monoculture (-2.916 g/day). During the recovery phase (Wk3ÃƒÆ’Ã†â€™Ãƒâ€ Ã¢â‚¬â„¢ÃƒÆ’Ã¢â‚¬Â ÃƒÂ¢Ã¢â€šÂ¬Ã¢â€žÂ¢ÃƒÆ’Ã†â€™ÃƒÂ¢Ã¢â€šÂ¬Ã…Â¡ÃƒÆ’Ã¢â‚¬Å¡Ãƒâ€šÃ‚Â¢ÃƒÆ’Ã†â€™Ãƒâ€ Ã¢â‚¬â„¢ÃƒÆ’Ã¢â‚¬Å¡Ãƒâ€šÃ‚Â¢ÃƒÆ’Ã†â€™Ãƒâ€šÃ‚Â¢ÃƒÆ’Ã‚Â¢ÃƒÂ¢Ã¢â€šÂ¬Ã…Â¡Ãƒâ€šÃ‚Â¬ÃƒÆ’Ã¢â‚¬Â¦Ãƒâ€šÃ‚Â¡ÃƒÆ’Ã†â€™ÃƒÂ¢Ã¢â€šÂ¬Ã…Â¡ÃƒÆ’Ã¢â‚¬Å¡Ãƒâ€šÃ‚Â¬ÃƒÆ’Ã†â€™Ãƒâ€ Ã¢â‚¬â„¢ÃƒÆ’Ã¢â‚¬Å¡Ãƒâ€šÃ‚Â¢ÃƒÆ’Ã†â€™Ãƒâ€šÃ‚Â¢ÃƒÆ’Ã‚Â¢ÃƒÂ¢Ã¢â‚¬Å¡Ã‚Â¬Ãƒâ€¦Ã‚Â¡ÃƒÆ’Ã¢â‚¬Å¡Ãƒâ€šÃ‚Â¬ÃƒÆ’Ã†â€™ÃƒÂ¢Ã¢â€šÂ¬Ã‚Â¦ÃƒÆ’Ã‚Â¢ÃƒÂ¢Ã¢â‚¬Å¡Ã‚Â¬Ãƒâ€¦Ã¢â‚¬Å“Wk4), both systems experienced strong positive growth, with Monoculture slightly higher (10.370 g/day) than IMTA (9.087 g/day).</w:t>
-      </w:r>
-    </w:p>
-    <w:p>
-      <w:pPr>
-        <w:spacing w:line="360" w:lineRule="auto"/>
-        <w:rPr>
-          <w:rFonts w:ascii="Times New Roman" w:hAnsi="Times New Roman" w:cs="Times New Roman"/>
-        </w:rPr>
-      </w:pPr>
-      <w:r>
-        <w:rPr>
-          <w:rFonts w:ascii="Times New Roman" w:hAnsi="Times New Roman" w:cs="Times New Roman"/>
-        </w:rPr>
-        <w:t xml:space="preserve">A major divergence occurred in the Wk4ÃƒÆ’Ã†â€™Ãƒâ€ Ã¢â‚¬â„¢ÃƒÆ’Ã¢â‚¬Â ÃƒÂ¢Ã¢â€šÂ¬Ã¢â€žÂ¢ÃƒÆ’Ã†â€™ÃƒÂ¢Ã¢â€šÂ¬Ã…Â¡ÃƒÆ’Ã¢â‚¬Å¡Ãƒâ€šÃ‚Â¢ÃƒÆ’Ã†â€™Ãƒâ€ Ã¢â‚¬â„¢ÃƒÆ’Ã¢â‚¬Å¡Ãƒâ€šÃ‚Â¢ÃƒÆ’Ã†â€™Ãƒâ€šÃ‚Â¢ÃƒÆ’Ã‚Â¢ÃƒÂ¢Ã¢â€šÂ¬Ã…Â¡Ãƒâ€šÃ‚Â¬ÃƒÆ’Ã¢â‚¬Â¦Ãƒâ€šÃ‚Â¡ÃƒÆ’Ã†â€™ÃƒÂ¢Ã¢â€šÂ¬Ã…Â¡ÃƒÆ’Ã¢â‚¬Å¡Ãƒâ€šÃ‚Â¬ÃƒÆ’Ã†â€™Ãƒâ€ Ã¢â‚¬â„¢ÃƒÆ’Ã¢â‚¬Å¡Ãƒâ€šÃ‚Â¢ÃƒÆ’Ã†â€™Ãƒâ€šÃ‚Â¢ÃƒÆ’Ã‚Â¢ÃƒÂ¢Ã¢â‚¬Å¡Ã‚Â¬Ãƒâ€¦Ã‚Â¡ÃƒÆ’Ã¢â‚¬Å¡Ãƒâ€šÃ‚Â¬ÃƒÆ’Ã†â€™ÃƒÂ¢Ã¢â€šÂ¬Ã‚Â¦ÃƒÆ’Ã‚Â¢ÃƒÂ¢Ã¢â‚¬Å¡Ã‚Â¬Ãƒâ€¦Ã¢â‚¬Å“Wk5 interval, where the Monoculture system showed a severe drop in growth (-27.608 g/day), while the IMTA system only recorded a minor decline (-2.266 g/day), indicating greater stability in the IMTA setup. In the final interval (Wk5ÃƒÆ’Ã†â€™Ãƒâ€ Ã¢â‚¬â„¢ÃƒÆ’Ã¢â‚¬Â ÃƒÂ¢Ã¢â€šÂ¬Ã¢â€žÂ¢ÃƒÆ’Ã†â€™ÃƒÂ¢Ã¢â€šÂ¬Ã…Â¡ÃƒÆ’Ã¢â‚¬Å¡Ãƒâ€šÃ‚Â¢ÃƒÆ’Ã†â€™Ãƒâ€ Ã¢â‚¬â„¢ÃƒÆ’Ã¢â‚¬Å¡Ãƒâ€šÃ‚Â¢ÃƒÆ’Ã†â€™Ãƒâ€šÃ‚Â¢ÃƒÆ’Ã‚Â¢ÃƒÂ¢Ã¢â€šÂ¬Ã…Â¡Ãƒâ€šÃ‚Â¬ÃƒÆ’Ã¢â‚¬Â¦Ãƒâ€šÃ‚Â¡ÃƒÆ’Ã†â€™ÃƒÂ¢Ã¢â€šÂ¬Ã…Â¡ÃƒÆ’Ã¢â‚¬Å¡Ãƒâ€šÃ‚Â¬ÃƒÆ’Ã†â€™Ãƒâ€ Ã¢â‚¬â„¢ÃƒÆ’Ã¢â‚¬Å¡Ãƒâ€šÃ‚Â¢ÃƒÆ’Ã†â€™Ãƒâ€šÃ‚Â¢ÃƒÆ’Ã‚Â¢ÃƒÂ¢Ã¢â‚¬Å¡Ã‚Â¬Ãƒâ€¦Ã‚Â¡ÃƒÆ’Ã¢â‚¬Å¡Ãƒâ€šÃ‚Â¬ÃƒÆ’Ã†â€™ÃƒÂ¢Ã¢â€šÂ¬Ã‚Â¦ÃƒÆ’Ã‚Â¢ÃƒÂ¢Ã¢â‚¬Å¡Ã‚Â¬Ãƒâ€¦Ã¢â‚¬Å“Wk6), both systems recovered again, with Monoculture reaching the highest AGR (13.854 g/day) and IMTA recording 8.307 g/day. Overall, although the Monoculture system achieved higher peak growth rates, the IMTA system demonstrated more stable and consistent growth performance, </w:t>
+        <w:t xml:space="preserve"> in IMTA and Monoculture systems across four sampling intervals. Overall, both systems show fluctuating growth patterns, including periods of weight loss and recovery. In the early phase (Wk2ÃƒÆ’Ã†â€™Ãƒâ€ Ã¢â‚¬â„¢ÃƒÆ’Ã¢â‚¬Â ÃƒÂ¢Ã¢â€šÂ¬Ã¢â€žÂ¢ÃƒÆ’Ã†â€™ÃƒÂ¢Ã¢â€šÂ¬Ã‚Â ÃƒÆ’Ã‚Â¢ÃƒÂ¢Ã¢â‚¬Å¡Ã‚Â¬ÃƒÂ¢Ã¢â‚¬Å¾Ã‚Â¢ÃƒÆ’Ã†â€™Ãƒâ€ Ã¢â‚¬â„¢ÃƒÆ’Ã‚Â¢ÃƒÂ¢Ã¢â‚¬Å¡Ã‚Â¬Ãƒâ€¦Ã‚Â¡ÃƒÆ’Ã†â€™ÃƒÂ¢Ã¢â€šÂ¬Ã…Â¡ÃƒÆ’Ã¢â‚¬Å¡Ãƒâ€šÃ‚Â¢ÃƒÆ’Ã†â€™Ãƒâ€ Ã¢â‚¬â„¢ÃƒÆ’Ã¢â‚¬Â ÃƒÂ¢Ã¢â€šÂ¬Ã¢â€žÂ¢ÃƒÆ’Ã†â€™ÃƒÂ¢Ã¢â€šÂ¬Ã…Â¡ÃƒÆ’Ã¢â‚¬Å¡Ãƒâ€šÃ‚Â¢ÃƒÆ’Ã†â€™Ãƒâ€ Ã¢â‚¬â„¢ÃƒÆ’Ã¢â‚¬Å¡Ãƒâ€šÃ‚Â¢ÃƒÆ’Ã†â€™Ãƒâ€šÃ‚Â¢ÃƒÆ’Ã‚Â¢ÃƒÂ¢Ã¢â‚¬Å¡Ã‚Â¬Ãƒâ€¦Ã‚Â¡ÃƒÆ’Ã¢â‚¬Å¡Ãƒâ€šÃ‚Â¬ÃƒÆ’Ã†â€™ÃƒÂ¢Ã¢â€šÂ¬Ã‚Â¦ÃƒÆ’Ã¢â‚¬Å¡Ãƒâ€šÃ‚Â¡ÃƒÆ’Ã†â€™Ãƒâ€ Ã¢â‚¬â„¢ÃƒÆ’Ã‚Â¢ÃƒÂ¢Ã¢â‚¬Å¡Ã‚Â¬Ãƒâ€¦Ã‚Â¡ÃƒÆ’Ã†â€™ÃƒÂ¢Ã¢â€šÂ¬Ã…Â¡ÃƒÆ’Ã¢â‚¬Å¡Ãƒâ€šÃ‚Â¬ÃƒÆ’Ã†â€™Ãƒâ€ Ã¢â‚¬â„¢ÃƒÆ’Ã¢â‚¬Â ÃƒÂ¢Ã¢â€šÂ¬Ã¢â€žÂ¢ÃƒÆ’Ã†â€™ÃƒÂ¢Ã¢â€šÂ¬Ã…Â¡ÃƒÆ’Ã¢â‚¬Å¡Ãƒâ€šÃ‚Â¢ÃƒÆ’Ã†â€™Ãƒâ€ Ã¢â‚¬â„¢ÃƒÆ’Ã¢â‚¬Å¡Ãƒâ€šÃ‚Â¢ÃƒÆ’Ã†â€™Ãƒâ€šÃ‚Â¢ÃƒÆ’Ã‚Â¢ÃƒÂ¢Ã¢â€šÂ¬Ã…Â¡Ãƒâ€šÃ‚Â¬ÃƒÆ’Ã¢â‚¬Â¦Ãƒâ€šÃ‚Â¡ÃƒÆ’Ã†â€™ÃƒÂ¢Ã¢â€šÂ¬Ã…Â¡ÃƒÆ’Ã¢â‚¬Å¡Ãƒâ€šÃ‚Â¬ÃƒÆ’Ã†â€™Ãƒâ€ Ã¢â‚¬â„¢ÃƒÆ’Ã‚Â¢ÃƒÂ¢Ã¢â‚¬Å¡Ã‚Â¬Ãƒâ€šÃ‚Â¦ÃƒÆ’Ã†â€™Ãƒâ€šÃ‚Â¢ÃƒÆ’Ã‚Â¢ÃƒÂ¢Ã¢â€šÂ¬Ã…Â¡Ãƒâ€šÃ‚Â¬ÃƒÆ’Ã¢â‚¬Â¦ÃƒÂ¢Ã¢â€šÂ¬Ã…â€œWk3), both treatments recorded negative growth rates, with the IMTA system showing a sharper decline (-5.953 g/day) compared to the Monoculture (-2.916 g/day). During the recovery phase (Wk3ÃƒÆ’Ã†â€™Ãƒâ€ Ã¢â‚¬â„¢ÃƒÆ’Ã¢â‚¬Â ÃƒÂ¢Ã¢â€šÂ¬Ã¢â€žÂ¢ÃƒÆ’Ã†â€™ÃƒÂ¢Ã¢â€šÂ¬Ã‚Â ÃƒÆ’Ã‚Â¢ÃƒÂ¢Ã¢â‚¬Å¡Ã‚Â¬ÃƒÂ¢Ã¢â‚¬Å¾Ã‚Â¢ÃƒÆ’Ã†â€™Ãƒâ€ Ã¢â‚¬â„¢ÃƒÆ’Ã‚Â¢ÃƒÂ¢Ã¢â‚¬Å¡Ã‚Â¬Ãƒâ€¦Ã‚Â¡ÃƒÆ’Ã†â€™ÃƒÂ¢Ã¢â€šÂ¬Ã…Â¡ÃƒÆ’Ã¢â‚¬Å¡Ãƒâ€šÃ‚Â¢ÃƒÆ’Ã†â€™Ãƒâ€ Ã¢â‚¬â„¢ÃƒÆ’Ã¢â‚¬Â ÃƒÂ¢Ã¢â€šÂ¬Ã¢â€žÂ¢ÃƒÆ’Ã†â€™ÃƒÂ¢Ã¢â€šÂ¬Ã…Â¡ÃƒÆ’Ã¢â‚¬Å¡Ãƒâ€šÃ‚Â¢ÃƒÆ’Ã†â€™Ãƒâ€ Ã¢â‚¬â„¢ÃƒÆ’Ã¢â‚¬Å¡Ãƒâ€šÃ‚Â¢ÃƒÆ’Ã†â€™Ãƒâ€šÃ‚Â¢ÃƒÆ’Ã‚Â¢ÃƒÂ¢Ã¢â‚¬Å¡Ã‚Â¬Ãƒâ€¦Ã‚Â¡ÃƒÆ’Ã¢â‚¬Å¡Ãƒâ€šÃ‚Â¬ÃƒÆ’Ã†â€™ÃƒÂ¢Ã¢â€šÂ¬Ã‚Â¦ÃƒÆ’Ã¢â‚¬Å¡Ãƒâ€šÃ‚Â¡ÃƒÆ’Ã†â€™Ãƒâ€ Ã¢â‚¬â„¢ÃƒÆ’Ã‚Â¢ÃƒÂ¢Ã¢â‚¬Å¡Ã‚Â¬Ãƒâ€¦Ã‚Â¡ÃƒÆ’Ã†â€™ÃƒÂ¢Ã¢â€šÂ¬Ã…Â¡ÃƒÆ’Ã¢â‚¬Å¡Ãƒâ€šÃ‚Â¬ÃƒÆ’Ã†â€™Ãƒâ€ Ã¢â‚¬â„¢ÃƒÆ’Ã¢â‚¬Â ÃƒÂ¢Ã¢â€šÂ¬Ã¢â€žÂ¢ÃƒÆ’Ã†â€™ÃƒÂ¢Ã¢â€šÂ¬Ã…Â¡ÃƒÆ’Ã¢â‚¬Å¡Ãƒâ€šÃ‚Â¢ÃƒÆ’Ã†â€™Ãƒâ€ Ã¢â‚¬â„¢ÃƒÆ’Ã¢â‚¬Å¡Ãƒâ€šÃ‚Â¢ÃƒÆ’Ã†â€™Ãƒâ€šÃ‚Â¢ÃƒÆ’Ã‚Â¢ÃƒÂ¢Ã¢â€šÂ¬Ã…Â¡Ãƒâ€šÃ‚Â¬ÃƒÆ’Ã¢â‚¬Â¦Ãƒâ€šÃ‚Â¡ÃƒÆ’Ã†â€™ÃƒÂ¢Ã¢â€šÂ¬Ã…Â¡ÃƒÆ’Ã¢â‚¬Å¡Ãƒâ€šÃ‚Â¬ÃƒÆ’Ã†â€™Ãƒâ€ Ã¢â‚¬â„¢ÃƒÆ’Ã‚Â¢ÃƒÂ¢Ã¢â‚¬Å¡Ã‚Â¬Ãƒâ€šÃ‚Â¦ÃƒÆ’Ã†â€™Ãƒâ€šÃ‚Â¢ÃƒÆ’Ã‚Â¢ÃƒÂ¢Ã¢â€šÂ¬Ã…Â¡Ãƒâ€šÃ‚Â¬ÃƒÆ’Ã¢â‚¬Â¦ÃƒÂ¢Ã¢â€šÂ¬Ã…â€œWk4), both systems experienced strong positive growth, with Monoculture slightly higher (10.370 g/day) than IMTA (9.087 g/day).</w:t>
+      </w:r>
+    </w:p>
+    <w:p>
+      <w:pPr>
+        <w:spacing w:line="360" w:lineRule="auto"/>
+        <w:rPr>
+          <w:rFonts w:ascii="Times New Roman" w:hAnsi="Times New Roman" w:cs="Times New Roman"/>
+        </w:rPr>
+      </w:pPr>
+      <w:r>
+        <w:rPr>
+          <w:rFonts w:ascii="Times New Roman" w:hAnsi="Times New Roman" w:cs="Times New Roman"/>
+        </w:rPr>
+        <w:t xml:space="preserve">A major divergence occurred in the Wk4ÃƒÆ’Ã†â€™Ãƒâ€ Ã¢â‚¬â„¢ÃƒÆ’Ã¢â‚¬Â ÃƒÂ¢Ã¢â€šÂ¬Ã¢â€žÂ¢ÃƒÆ’Ã†â€™ÃƒÂ¢Ã¢â€šÂ¬Ã‚Â ÃƒÆ’Ã‚Â¢ÃƒÂ¢Ã¢â‚¬Å¡Ã‚Â¬ÃƒÂ¢Ã¢â‚¬Å¾Ã‚Â¢ÃƒÆ’Ã†â€™Ãƒâ€ Ã¢â‚¬â„¢ÃƒÆ’Ã‚Â¢ÃƒÂ¢Ã¢â‚¬Å¡Ã‚Â¬Ãƒâ€¦Ã‚Â¡ÃƒÆ’Ã†â€™ÃƒÂ¢Ã¢â€šÂ¬Ã…Â¡ÃƒÆ’Ã¢â‚¬Å¡Ãƒâ€šÃ‚Â¢ÃƒÆ’Ã†â€™Ãƒâ€ Ã¢â‚¬â„¢ÃƒÆ’Ã¢â‚¬Â ÃƒÂ¢Ã¢â€šÂ¬Ã¢â€žÂ¢ÃƒÆ’Ã†â€™ÃƒÂ¢Ã¢â€šÂ¬Ã…Â¡ÃƒÆ’Ã¢â‚¬Å¡Ãƒâ€šÃ‚Â¢ÃƒÆ’Ã†â€™Ãƒâ€ Ã¢â‚¬â„¢ÃƒÆ’Ã¢â‚¬Å¡Ãƒâ€šÃ‚Â¢ÃƒÆ’Ã†â€™Ãƒâ€šÃ‚Â¢ÃƒÆ’Ã‚Â¢ÃƒÂ¢Ã¢â‚¬Å¡Ã‚Â¬Ãƒâ€¦Ã‚Â¡ÃƒÆ’Ã¢â‚¬Å¡Ãƒâ€šÃ‚Â¬ÃƒÆ’Ã†â€™ÃƒÂ¢Ã¢â€šÂ¬Ã‚Â¦ÃƒÆ’Ã¢â‚¬Å¡Ãƒâ€šÃ‚Â¡ÃƒÆ’Ã†â€™Ãƒâ€ Ã¢â‚¬â„¢ÃƒÆ’Ã‚Â¢ÃƒÂ¢Ã¢â‚¬Å¡Ã‚Â¬Ãƒâ€¦Ã‚Â¡ÃƒÆ’Ã†â€™ÃƒÂ¢Ã¢â€šÂ¬Ã…Â¡ÃƒÆ’Ã¢â‚¬Å¡Ãƒâ€šÃ‚Â¬ÃƒÆ’Ã†â€™Ãƒâ€ Ã¢â‚¬â„¢ÃƒÆ’Ã¢â‚¬Â ÃƒÂ¢Ã¢â€šÂ¬Ã¢â€žÂ¢ÃƒÆ’Ã†â€™ÃƒÂ¢Ã¢â€šÂ¬Ã…Â¡ÃƒÆ’Ã¢â‚¬Å¡Ãƒâ€šÃ‚Â¢ÃƒÆ’Ã†â€™Ãƒâ€ Ã¢â‚¬â„¢ÃƒÆ’Ã¢â‚¬Å¡Ãƒâ€šÃ‚Â¢ÃƒÆ’Ã†â€™Ãƒâ€šÃ‚Â¢ÃƒÆ’Ã‚Â¢ÃƒÂ¢Ã¢â€šÂ¬Ã…Â¡Ãƒâ€šÃ‚Â¬ÃƒÆ’Ã¢â‚¬Â¦Ãƒâ€šÃ‚Â¡ÃƒÆ’Ã†â€™ÃƒÂ¢Ã¢â€šÂ¬Ã…Â¡ÃƒÆ’Ã¢â‚¬Å¡Ãƒâ€šÃ‚Â¬ÃƒÆ’Ã†â€™Ãƒâ€ Ã¢â‚¬â„¢ÃƒÆ’Ã‚Â¢ÃƒÂ¢Ã¢â‚¬Å¡Ã‚Â¬Ãƒâ€šÃ‚Â¦ÃƒÆ’Ã†â€™Ãƒâ€šÃ‚Â¢ÃƒÆ’Ã‚Â¢ÃƒÂ¢Ã¢â€šÂ¬Ã…Â¡Ãƒâ€šÃ‚Â¬ÃƒÆ’Ã¢â‚¬Â¦ÃƒÂ¢Ã¢â€šÂ¬Ã…â€œWk5 interval, where the Monoculture system showed a severe drop in growth (-27.608 g/day), while the IMTA system only recorded a minor decline (-2.266 g/day), indicating greater stability in the IMTA setup. In the final interval (Wk5ÃƒÆ’Ã†â€™Ãƒâ€ Ã¢â‚¬â„¢ÃƒÆ’Ã¢â‚¬Â ÃƒÂ¢Ã¢â€šÂ¬Ã¢â€žÂ¢ÃƒÆ’Ã†â€™ÃƒÂ¢Ã¢â€šÂ¬Ã‚Â ÃƒÆ’Ã‚Â¢ÃƒÂ¢Ã¢â‚¬Å¡Ã‚Â¬ÃƒÂ¢Ã¢â‚¬Å¾Ã‚Â¢ÃƒÆ’Ã†â€™Ãƒâ€ Ã¢â‚¬â„¢ÃƒÆ’Ã‚Â¢ÃƒÂ¢Ã¢â‚¬Å¡Ã‚Â¬Ãƒâ€¦Ã‚Â¡ÃƒÆ’Ã†â€™ÃƒÂ¢Ã¢â€šÂ¬Ã…Â¡ÃƒÆ’Ã¢â‚¬Å¡Ãƒâ€šÃ‚Â¢ÃƒÆ’Ã†â€™Ãƒâ€ Ã¢â‚¬â„¢ÃƒÆ’Ã¢â‚¬Â ÃƒÂ¢Ã¢â€šÂ¬Ã¢â€žÂ¢ÃƒÆ’Ã†â€™ÃƒÂ¢Ã¢â€šÂ¬Ã…Â¡ÃƒÆ’Ã¢â‚¬Å¡Ãƒâ€šÃ‚Â¢ÃƒÆ’Ã†â€™Ãƒâ€ Ã¢â‚¬â„¢ÃƒÆ’Ã¢â‚¬Å¡Ãƒâ€šÃ‚Â¢ÃƒÆ’Ã†â€™Ãƒâ€šÃ‚Â¢ÃƒÆ’Ã‚Â¢ÃƒÂ¢Ã¢â‚¬Å¡Ã‚Â¬Ãƒâ€¦Ã‚Â¡ÃƒÆ’Ã¢â‚¬Å¡Ãƒâ€šÃ‚Â¬ÃƒÆ’Ã†â€™ÃƒÂ¢Ã¢â€šÂ¬Ã‚Â¦ÃƒÆ’Ã¢â‚¬Å¡Ãƒâ€šÃ‚Â¡ÃƒÆ’Ã†â€™Ãƒâ€ Ã¢â‚¬â„¢ÃƒÆ’Ã‚Â¢ÃƒÂ¢Ã¢â‚¬Å¡Ã‚Â¬Ãƒâ€¦Ã‚Â¡ÃƒÆ’Ã†â€™ÃƒÂ¢Ã¢â€šÂ¬Ã…Â¡ÃƒÆ’Ã¢â‚¬Å¡Ãƒâ€šÃ‚Â¬ÃƒÆ’Ã†â€™Ãƒâ€ Ã¢â‚¬â„¢ÃƒÆ’Ã¢â‚¬Â ÃƒÂ¢Ã¢â€šÂ¬Ã¢â€žÂ¢ÃƒÆ’Ã†â€™ÃƒÂ¢Ã¢â€šÂ¬Ã…Â¡ÃƒÆ’Ã¢â‚¬Å¡Ãƒâ€šÃ‚Â¢ÃƒÆ’Ã†â€™Ãƒâ€ Ã¢â‚¬â„¢ÃƒÆ’Ã¢â‚¬Å¡Ãƒâ€šÃ‚Â¢ÃƒÆ’Ã†â€™Ãƒâ€šÃ‚Â¢ÃƒÆ’Ã‚Â¢ÃƒÂ¢Ã¢â€šÂ¬Ã…Â¡Ãƒâ€šÃ‚Â¬ÃƒÆ’Ã¢â‚¬Â¦Ãƒâ€šÃ‚Â¡ÃƒÆ’Ã†â€™ÃƒÂ¢Ã¢â€šÂ¬Ã…Â¡ÃƒÆ’Ã¢â‚¬Å¡Ãƒâ€šÃ‚Â¬ÃƒÆ’Ã†â€™Ãƒâ€ Ã¢â‚¬â„¢ÃƒÆ’Ã‚Â¢ÃƒÂ¢Ã¢â‚¬Å¡Ã‚Â¬Ãƒâ€šÃ‚Â¦ÃƒÆ’Ã†â€™Ãƒâ€šÃ‚Â¢ÃƒÆ’Ã‚Â¢ÃƒÂ¢Ã¢â€šÂ¬Ã…Â¡Ãƒâ€šÃ‚Â¬ÃƒÆ’Ã¢â‚¬Â¦ÃƒÂ¢Ã¢â€šÂ¬Ã…â€œWk6), both systems recovered again, with Monoculture reaching the highest AGR (13.854 g/day) and IMTA recording 8.307 g/day. Overall, although the Monoculture system achieved higher peak growth rates, the IMTA system demonstrated more stable and consistent growth performance, </w:t>
       </w:r>
       <w:r>
         <w:rPr>
@@ -2466,21 +2466,21 @@
         <w:rPr>
           <w:rFonts w:ascii="Times New Roman" w:hAnsi="Times New Roman" w:cs="Times New Roman"/>
         </w:rPr>
-        <w:t xml:space="preserve"> (%/day) in IMTA and Monoculture systems across four sampling intervals. Overall, both treatments show fluctuating growth patterns, including phases of weight loss and recovery. During the initial adaptation phase (Wk2ÃƒÆ’Ã†â€™Ãƒâ€ Ã¢â‚¬â„¢ÃƒÆ’Ã¢â‚¬Â ÃƒÂ¢Ã¢â€šÂ¬Ã¢â€žÂ¢ÃƒÆ’Ã†â€™ÃƒÂ¢Ã¢â€šÂ¬Ã…Â¡ÃƒÆ’Ã¢â‚¬Å¡Ãƒâ€šÃ‚Â¢ÃƒÆ’Ã†â€™Ãƒâ€ Ã¢â‚¬â„¢ÃƒÆ’Ã¢â‚¬Å¡Ãƒâ€šÃ‚Â¢ÃƒÆ’Ã†â€™Ãƒâ€šÃ‚Â¢ÃƒÆ’Ã‚Â¢ÃƒÂ¢Ã¢â€šÂ¬Ã…Â¡Ãƒâ€šÃ‚Â¬ÃƒÆ’Ã¢â‚¬Â¦Ãƒâ€šÃ‚Â¡ÃƒÆ’Ã†â€™ÃƒÂ¢Ã¢â€šÂ¬Ã…Â¡ÃƒÆ’Ã¢â‚¬Å¡Ãƒâ€šÃ‚Â¬ÃƒÆ’Ã†â€™Ãƒâ€ Ã¢â‚¬â„¢ÃƒÆ’Ã¢â‚¬Å¡Ãƒâ€šÃ‚Â¢ÃƒÆ’Ã†â€™Ãƒâ€šÃ‚Â¢ÃƒÆ’Ã‚Â¢ÃƒÂ¢Ã¢â‚¬Å¡Ã‚Â¬Ãƒâ€¦Ã‚Â¡ÃƒÆ’Ã¢â‚¬Å¡Ãƒâ€šÃ‚Â¬ÃƒÆ’Ã†â€™ÃƒÂ¢Ã¢â€šÂ¬Ã‚Â¦ÃƒÆ’Ã‚Â¢ÃƒÂ¢Ã¢â‚¬Å¡Ã‚Â¬Ãƒâ€¦Ã¢â‚¬Å“Wk3), both systems recorded negative growth, with the IMTA group showing a slightly greater decline (-1.977%/day) compared to Monoculture (-0.985%/day). In the subsequent phase (Wk3ÃƒÆ’Ã†â€™Ãƒâ€ Ã¢â‚¬â„¢ÃƒÆ’Ã¢â‚¬Â ÃƒÂ¢Ã¢â€šÂ¬Ã¢â€žÂ¢ÃƒÆ’Ã†â€™ÃƒÂ¢Ã¢â€šÂ¬Ã…Â¡ÃƒÆ’Ã¢â‚¬Å¡Ãƒâ€šÃ‚Â¢ÃƒÆ’Ã†â€™Ãƒâ€ Ã¢â‚¬â„¢ÃƒÆ’Ã¢â‚¬Å¡Ãƒâ€šÃ‚Â¢ÃƒÆ’Ã†â€™Ãƒâ€šÃ‚Â¢ÃƒÆ’Ã‚Â¢ÃƒÂ¢Ã¢â€šÂ¬Ã…Â¡Ãƒâ€šÃ‚Â¬ÃƒÆ’Ã¢â‚¬Â¦Ãƒâ€šÃ‚Â¡ÃƒÆ’Ã†â€™ÃƒÂ¢Ã¢â€šÂ¬Ã…Â¡ÃƒÆ’Ã¢â‚¬Å¡Ãƒâ€šÃ‚Â¬ÃƒÆ’Ã†â€™Ãƒâ€ Ã¢â‚¬â„¢ÃƒÆ’Ã¢â‚¬Å¡Ãƒâ€šÃ‚Â¢ÃƒÆ’Ã†â€™Ãƒâ€šÃ‚Â¢ÃƒÆ’Ã‚Â¢ÃƒÂ¢Ã¢â‚¬Å¡Ã‚Â¬Ãƒâ€¦Ã‚Â¡ÃƒÆ’Ã¢â‚¬Å¡Ãƒâ€šÃ‚Â¬ÃƒÆ’Ã†â€™ÃƒÂ¢Ã¢â€šÂ¬Ã‚Â¦ÃƒÆ’Ã‚Â¢ÃƒÂ¢Ã¢â‚¬Å¡Ã‚Â¬Ãƒâ€¦Ã¢â‚¬Å“Wk4), both systems recovered strongly, with Monoculture showing a slightly higher growth rate (3.227%/day) than IMTA (2.958%/day).</w:t>
-      </w:r>
-    </w:p>
-    <w:p>
-      <w:pPr>
-        <w:spacing w:line="360" w:lineRule="auto"/>
-        <w:rPr>
-          <w:rFonts w:ascii="Times New Roman" w:hAnsi="Times New Roman" w:cs="Times New Roman"/>
-        </w:rPr>
-      </w:pPr>
-      <w:r>
-        <w:rPr>
-          <w:rFonts w:ascii="Times New Roman" w:hAnsi="Times New Roman" w:cs="Times New Roman"/>
-        </w:rPr>
-        <w:t xml:space="preserve">A clear difference in stability is observed during the Wk4ÃƒÆ’Ã†â€™Ãƒâ€ Ã¢â‚¬â„¢ÃƒÆ’Ã¢â‚¬Â ÃƒÂ¢Ã¢â€šÂ¬Ã¢â€žÂ¢ÃƒÆ’Ã†â€™ÃƒÂ¢Ã¢â€šÂ¬Ã…Â¡ÃƒÆ’Ã¢â‚¬Å¡Ãƒâ€šÃ‚Â¢ÃƒÆ’Ã†â€™Ãƒâ€ Ã¢â‚¬â„¢ÃƒÆ’Ã¢â‚¬Å¡Ãƒâ€šÃ‚Â¢ÃƒÆ’Ã†â€™Ãƒâ€šÃ‚Â¢ÃƒÆ’Ã‚Â¢ÃƒÂ¢Ã¢â€šÂ¬Ã…Â¡Ãƒâ€šÃ‚Â¬ÃƒÆ’Ã¢â‚¬Â¦Ãƒâ€šÃ‚Â¡ÃƒÆ’Ã†â€™ÃƒÂ¢Ã¢â€šÂ¬Ã…Â¡ÃƒÆ’Ã¢â‚¬Å¡Ãƒâ€šÃ‚Â¬ÃƒÆ’Ã†â€™Ãƒâ€ Ã¢â‚¬â„¢ÃƒÆ’Ã¢â‚¬Å¡Ãƒâ€šÃ‚Â¢ÃƒÆ’Ã†â€™Ãƒâ€šÃ‚Â¢ÃƒÆ’Ã‚Â¢ÃƒÂ¢Ã¢â‚¬Å¡Ã‚Â¬Ãƒâ€¦Ã‚Â¡ÃƒÆ’Ã¢â‚¬Å¡Ãƒâ€šÃ‚Â¬ÃƒÆ’Ã†â€™ÃƒÂ¢Ã¢â€šÂ¬Ã‚Â¦ÃƒÆ’Ã‚Â¢ÃƒÂ¢Ã¢â‚¬Å¡Ã‚Â¬Ãƒâ€¦Ã¢â‚¬Å“Wk5 interval, where the IMTA system remained relatively stable with a minor decline (-0.668%/day), while the Monoculture system experienced a sharp drop in growth (-9.516%/day), indicating strong physiological stress. In the final phase (Wk5ÃƒÆ’Ã†â€™Ãƒâ€ Ã¢â‚¬â„¢ÃƒÆ’Ã¢â‚¬Â ÃƒÂ¢Ã¢â€šÂ¬Ã¢â€žÂ¢ÃƒÆ’Ã†â€™ÃƒÂ¢Ã¢â€šÂ¬Ã…Â¡ÃƒÆ’Ã¢â‚¬Å¡Ãƒâ€šÃ‚Â¢ÃƒÆ’Ã†â€™Ãƒâ€ Ã¢â‚¬â„¢ÃƒÆ’Ã¢â‚¬Å¡Ãƒâ€šÃ‚Â¢ÃƒÆ’Ã†â€™Ãƒâ€šÃ‚Â¢ÃƒÆ’Ã‚Â¢ÃƒÂ¢Ã¢â€šÂ¬Ã…Â¡Ãƒâ€šÃ‚Â¬ÃƒÆ’Ã¢â‚¬Â¦Ãƒâ€šÃ‚Â¡ÃƒÆ’Ã†â€™ÃƒÂ¢Ã¢â€šÂ¬Ã…Â¡ÃƒÆ’Ã¢â‚¬Å¡Ãƒâ€šÃ‚Â¬ÃƒÆ’Ã†â€™Ãƒâ€ Ã¢â‚¬â„¢ÃƒÆ’Ã¢â‚¬Å¡Ãƒâ€šÃ‚Â¢ÃƒÆ’Ã†â€™Ãƒâ€šÃ‚Â¢ÃƒÆ’Ã‚Â¢ÃƒÂ¢Ã¢â‚¬Å¡Ã‚Â¬Ãƒâ€¦Ã‚Â¡ÃƒÆ’Ã¢â‚¬Å¡Ãƒâ€šÃ‚Â¬ÃƒÆ’Ã†â€™ÃƒÂ¢Ã¢â€šÂ¬Ã‚Â¦ÃƒÆ’Ã‚Â¢ÃƒÂ¢Ã¢â‚¬Å¡Ã‚Â¬Ãƒâ€¦Ã¢â‚¬Å“Wk6), both systems recovered, with Monoculture reaching a higher peak growth rate (4.872%/day) compared to IMTA (2.246%/day). Overall, although Monoculture showed higher peak SGR values, the IMTA system demonstrated more stable and consistent </w:t>
+        <w:t xml:space="preserve"> (%/day) in IMTA and Monoculture systems across four sampling intervals. Overall, both treatments show fluctuating growth patterns, including phases of weight loss and recovery. During the initial adaptation phase (Wk2ÃƒÆ’Ã†â€™Ãƒâ€ Ã¢â‚¬â„¢ÃƒÆ’Ã¢â‚¬Â ÃƒÂ¢Ã¢â€šÂ¬Ã¢â€žÂ¢ÃƒÆ’Ã†â€™ÃƒÂ¢Ã¢â€šÂ¬Ã‚Â ÃƒÆ’Ã‚Â¢ÃƒÂ¢Ã¢â‚¬Å¡Ã‚Â¬ÃƒÂ¢Ã¢â‚¬Å¾Ã‚Â¢ÃƒÆ’Ã†â€™Ãƒâ€ Ã¢â‚¬â„¢ÃƒÆ’Ã‚Â¢ÃƒÂ¢Ã¢â‚¬Å¡Ã‚Â¬Ãƒâ€¦Ã‚Â¡ÃƒÆ’Ã†â€™ÃƒÂ¢Ã¢â€šÂ¬Ã…Â¡ÃƒÆ’Ã¢â‚¬Å¡Ãƒâ€šÃ‚Â¢ÃƒÆ’Ã†â€™Ãƒâ€ Ã¢â‚¬â„¢ÃƒÆ’Ã¢â‚¬Â ÃƒÂ¢Ã¢â€šÂ¬Ã¢â€žÂ¢ÃƒÆ’Ã†â€™ÃƒÂ¢Ã¢â€šÂ¬Ã…Â¡ÃƒÆ’Ã¢â‚¬Å¡Ãƒâ€šÃ‚Â¢ÃƒÆ’Ã†â€™Ãƒâ€ Ã¢â‚¬â„¢ÃƒÆ’Ã¢â‚¬Å¡Ãƒâ€šÃ‚Â¢ÃƒÆ’Ã†â€™Ãƒâ€šÃ‚Â¢ÃƒÆ’Ã‚Â¢ÃƒÂ¢Ã¢â‚¬Å¡Ã‚Â¬Ãƒâ€¦Ã‚Â¡ÃƒÆ’Ã¢â‚¬Å¡Ãƒâ€šÃ‚Â¬ÃƒÆ’Ã†â€™ÃƒÂ¢Ã¢â€šÂ¬Ã‚Â¦ÃƒÆ’Ã¢â‚¬Å¡Ãƒâ€šÃ‚Â¡ÃƒÆ’Ã†â€™Ãƒâ€ Ã¢â‚¬â„¢ÃƒÆ’Ã‚Â¢ÃƒÂ¢Ã¢â‚¬Å¡Ã‚Â¬Ãƒâ€¦Ã‚Â¡ÃƒÆ’Ã†â€™ÃƒÂ¢Ã¢â€šÂ¬Ã…Â¡ÃƒÆ’Ã¢â‚¬Å¡Ãƒâ€šÃ‚Â¬ÃƒÆ’Ã†â€™Ãƒâ€ Ã¢â‚¬â„¢ÃƒÆ’Ã¢â‚¬Â ÃƒÂ¢Ã¢â€šÂ¬Ã¢â€žÂ¢ÃƒÆ’Ã†â€™ÃƒÂ¢Ã¢â€šÂ¬Ã…Â¡ÃƒÆ’Ã¢â‚¬Å¡Ãƒâ€šÃ‚Â¢ÃƒÆ’Ã†â€™Ãƒâ€ Ã¢â‚¬â„¢ÃƒÆ’Ã¢â‚¬Å¡Ãƒâ€šÃ‚Â¢ÃƒÆ’Ã†â€™Ãƒâ€šÃ‚Â¢ÃƒÆ’Ã‚Â¢ÃƒÂ¢Ã¢â€šÂ¬Ã…Â¡Ãƒâ€šÃ‚Â¬ÃƒÆ’Ã¢â‚¬Â¦Ãƒâ€šÃ‚Â¡ÃƒÆ’Ã†â€™ÃƒÂ¢Ã¢â€šÂ¬Ã…Â¡ÃƒÆ’Ã¢â‚¬Å¡Ãƒâ€šÃ‚Â¬ÃƒÆ’Ã†â€™Ãƒâ€ Ã¢â‚¬â„¢ÃƒÆ’Ã‚Â¢ÃƒÂ¢Ã¢â‚¬Å¡Ã‚Â¬Ãƒâ€šÃ‚Â¦ÃƒÆ’Ã†â€™Ãƒâ€šÃ‚Â¢ÃƒÆ’Ã‚Â¢ÃƒÂ¢Ã¢â€šÂ¬Ã…Â¡Ãƒâ€šÃ‚Â¬ÃƒÆ’Ã¢â‚¬Â¦ÃƒÂ¢Ã¢â€šÂ¬Ã…â€œWk3), both systems recorded negative growth, with the IMTA group showing a slightly greater decline (-1.977%/day) compared to Monoculture (-0.985%/day). In the subsequent phase (Wk3ÃƒÆ’Ã†â€™Ãƒâ€ Ã¢â‚¬â„¢ÃƒÆ’Ã¢â‚¬Â ÃƒÂ¢Ã¢â€šÂ¬Ã¢â€žÂ¢ÃƒÆ’Ã†â€™ÃƒÂ¢Ã¢â€šÂ¬Ã‚Â ÃƒÆ’Ã‚Â¢ÃƒÂ¢Ã¢â‚¬Å¡Ã‚Â¬ÃƒÂ¢Ã¢â‚¬Å¾Ã‚Â¢ÃƒÆ’Ã†â€™Ãƒâ€ Ã¢â‚¬â„¢ÃƒÆ’Ã‚Â¢ÃƒÂ¢Ã¢â‚¬Å¡Ã‚Â¬Ãƒâ€¦Ã‚Â¡ÃƒÆ’Ã†â€™ÃƒÂ¢Ã¢â€šÂ¬Ã…Â¡ÃƒÆ’Ã¢â‚¬Å¡Ãƒâ€šÃ‚Â¢ÃƒÆ’Ã†â€™Ãƒâ€ Ã¢â‚¬â„¢ÃƒÆ’Ã¢â‚¬Â ÃƒÂ¢Ã¢â€šÂ¬Ã¢â€žÂ¢ÃƒÆ’Ã†â€™ÃƒÂ¢Ã¢â€šÂ¬Ã…Â¡ÃƒÆ’Ã¢â‚¬Å¡Ãƒâ€šÃ‚Â¢ÃƒÆ’Ã†â€™Ãƒâ€ Ã¢â‚¬â„¢ÃƒÆ’Ã¢â‚¬Å¡Ãƒâ€šÃ‚Â¢ÃƒÆ’Ã†â€™Ãƒâ€šÃ‚Â¢ÃƒÆ’Ã‚Â¢ÃƒÂ¢Ã¢â‚¬Å¡Ã‚Â¬Ãƒâ€¦Ã‚Â¡ÃƒÆ’Ã¢â‚¬Å¡Ãƒâ€šÃ‚Â¬ÃƒÆ’Ã†â€™ÃƒÂ¢Ã¢â€šÂ¬Ã‚Â¦ÃƒÆ’Ã¢â‚¬Å¡Ãƒâ€šÃ‚Â¡ÃƒÆ’Ã†â€™Ãƒâ€ Ã¢â‚¬â„¢ÃƒÆ’Ã‚Â¢ÃƒÂ¢Ã¢â‚¬Å¡Ã‚Â¬Ãƒâ€¦Ã‚Â¡ÃƒÆ’Ã†â€™ÃƒÂ¢Ã¢â€šÂ¬Ã…Â¡ÃƒÆ’Ã¢â‚¬Å¡Ãƒâ€šÃ‚Â¬ÃƒÆ’Ã†â€™Ãƒâ€ Ã¢â‚¬â„¢ÃƒÆ’Ã¢â‚¬Â ÃƒÂ¢Ã¢â€šÂ¬Ã¢â€žÂ¢ÃƒÆ’Ã†â€™ÃƒÂ¢Ã¢â€šÂ¬Ã…Â¡ÃƒÆ’Ã¢â‚¬Å¡Ãƒâ€šÃ‚Â¢ÃƒÆ’Ã†â€™Ãƒâ€ Ã¢â‚¬â„¢ÃƒÆ’Ã¢â‚¬Å¡Ãƒâ€šÃ‚Â¢ÃƒÆ’Ã†â€™Ãƒâ€šÃ‚Â¢ÃƒÆ’Ã‚Â¢ÃƒÂ¢Ã¢â€šÂ¬Ã…Â¡Ãƒâ€šÃ‚Â¬ÃƒÆ’Ã¢â‚¬Â¦Ãƒâ€šÃ‚Â¡ÃƒÆ’Ã†â€™ÃƒÂ¢Ã¢â€šÂ¬Ã…Â¡ÃƒÆ’Ã¢â‚¬Å¡Ãƒâ€šÃ‚Â¬ÃƒÆ’Ã†â€™Ãƒâ€ Ã¢â‚¬â„¢ÃƒÆ’Ã‚Â¢ÃƒÂ¢Ã¢â‚¬Å¡Ã‚Â¬Ãƒâ€šÃ‚Â¦ÃƒÆ’Ã†â€™Ãƒâ€šÃ‚Â¢ÃƒÆ’Ã‚Â¢ÃƒÂ¢Ã¢â€šÂ¬Ã…Â¡Ãƒâ€šÃ‚Â¬ÃƒÆ’Ã¢â‚¬Â¦ÃƒÂ¢Ã¢â€šÂ¬Ã…â€œWk4), both systems recovered strongly, with Monoculture showing a slightly higher growth rate (3.227%/day) than IMTA (2.958%/day).</w:t>
+      </w:r>
+    </w:p>
+    <w:p>
+      <w:pPr>
+        <w:spacing w:line="360" w:lineRule="auto"/>
+        <w:rPr>
+          <w:rFonts w:ascii="Times New Roman" w:hAnsi="Times New Roman" w:cs="Times New Roman"/>
+        </w:rPr>
+      </w:pPr>
+      <w:r>
+        <w:rPr>
+          <w:rFonts w:ascii="Times New Roman" w:hAnsi="Times New Roman" w:cs="Times New Roman"/>
+        </w:rPr>
+        <w:t xml:space="preserve">A clear difference in stability is observed during the Wk4ÃƒÆ’Ã†â€™Ãƒâ€ Ã¢â‚¬â„¢ÃƒÆ’Ã¢â‚¬Â ÃƒÂ¢Ã¢â€šÂ¬Ã¢â€žÂ¢ÃƒÆ’Ã†â€™ÃƒÂ¢Ã¢â€šÂ¬Ã‚Â ÃƒÆ’Ã‚Â¢ÃƒÂ¢Ã¢â‚¬Å¡Ã‚Â¬ÃƒÂ¢Ã¢â‚¬Å¾Ã‚Â¢ÃƒÆ’Ã†â€™Ãƒâ€ Ã¢â‚¬â„¢ÃƒÆ’Ã‚Â¢ÃƒÂ¢Ã¢â‚¬Å¡Ã‚Â¬Ãƒâ€¦Ã‚Â¡ÃƒÆ’Ã†â€™ÃƒÂ¢Ã¢â€šÂ¬Ã…Â¡ÃƒÆ’Ã¢â‚¬Å¡Ãƒâ€šÃ‚Â¢ÃƒÆ’Ã†â€™Ãƒâ€ Ã¢â‚¬â„¢ÃƒÆ’Ã¢â‚¬Â ÃƒÂ¢Ã¢â€šÂ¬Ã¢â€žÂ¢ÃƒÆ’Ã†â€™ÃƒÂ¢Ã¢â€šÂ¬Ã…Â¡ÃƒÆ’Ã¢â‚¬Å¡Ãƒâ€šÃ‚Â¢ÃƒÆ’Ã†â€™Ãƒâ€ Ã¢â‚¬â„¢ÃƒÆ’Ã¢â‚¬Å¡Ãƒâ€šÃ‚Â¢ÃƒÆ’Ã†â€™Ãƒâ€šÃ‚Â¢ÃƒÆ’Ã‚Â¢ÃƒÂ¢Ã¢â‚¬Å¡Ã‚Â¬Ãƒâ€¦Ã‚Â¡ÃƒÆ’Ã¢â‚¬Å¡Ãƒâ€šÃ‚Â¬ÃƒÆ’Ã†â€™ÃƒÂ¢Ã¢â€šÂ¬Ã‚Â¦ÃƒÆ’Ã¢â‚¬Å¡Ãƒâ€šÃ‚Â¡ÃƒÆ’Ã†â€™Ãƒâ€ Ã¢â‚¬â„¢ÃƒÆ’Ã‚Â¢ÃƒÂ¢Ã¢â‚¬Å¡Ã‚Â¬Ãƒâ€¦Ã‚Â¡ÃƒÆ’Ã†â€™ÃƒÂ¢Ã¢â€šÂ¬Ã…Â¡ÃƒÆ’Ã¢â‚¬Å¡Ãƒâ€šÃ‚Â¬ÃƒÆ’Ã†â€™Ãƒâ€ Ã¢â‚¬â„¢ÃƒÆ’Ã¢â‚¬Â ÃƒÂ¢Ã¢â€šÂ¬Ã¢â€žÂ¢ÃƒÆ’Ã†â€™ÃƒÂ¢Ã¢â€šÂ¬Ã…Â¡ÃƒÆ’Ã¢â‚¬Å¡Ãƒâ€šÃ‚Â¢ÃƒÆ’Ã†â€™Ãƒâ€ Ã¢â‚¬â„¢ÃƒÆ’Ã¢â‚¬Å¡Ãƒâ€šÃ‚Â¢ÃƒÆ’Ã†â€™Ãƒâ€šÃ‚Â¢ÃƒÆ’Ã‚Â¢ÃƒÂ¢Ã¢â€šÂ¬Ã…Â¡Ãƒâ€šÃ‚Â¬ÃƒÆ’Ã¢â‚¬Â¦Ãƒâ€šÃ‚Â¡ÃƒÆ’Ã†â€™ÃƒÂ¢Ã¢â€šÂ¬Ã…Â¡ÃƒÆ’Ã¢â‚¬Å¡Ãƒâ€šÃ‚Â¬ÃƒÆ’Ã†â€™Ãƒâ€ Ã¢â‚¬â„¢ÃƒÆ’Ã‚Â¢ÃƒÂ¢Ã¢â‚¬Å¡Ã‚Â¬Ãƒâ€šÃ‚Â¦ÃƒÆ’Ã†â€™Ãƒâ€šÃ‚Â¢ÃƒÆ’Ã‚Â¢ÃƒÂ¢Ã¢â€šÂ¬Ã…Â¡Ãƒâ€šÃ‚Â¬ÃƒÆ’Ã¢â‚¬Â¦ÃƒÂ¢Ã¢â€šÂ¬Ã…â€œWk5 interval, where the IMTA system remained relatively stable with a minor decline (-0.668%/day), while the Monoculture system experienced a sharp drop in growth (-9.516%/day), indicating strong physiological stress. In the final phase (Wk5ÃƒÆ’Ã†â€™Ãƒâ€ Ã¢â‚¬â„¢ÃƒÆ’Ã¢â‚¬Â ÃƒÂ¢Ã¢â€šÂ¬Ã¢â€žÂ¢ÃƒÆ’Ã†â€™ÃƒÂ¢Ã¢â€šÂ¬Ã‚Â ÃƒÆ’Ã‚Â¢ÃƒÂ¢Ã¢â‚¬Å¡Ã‚Â¬ÃƒÂ¢Ã¢â‚¬Å¾Ã‚Â¢ÃƒÆ’Ã†â€™Ãƒâ€ Ã¢â‚¬â„¢ÃƒÆ’Ã‚Â¢ÃƒÂ¢Ã¢â‚¬Å¡Ã‚Â¬Ãƒâ€¦Ã‚Â¡ÃƒÆ’Ã†â€™ÃƒÂ¢Ã¢â€šÂ¬Ã…Â¡ÃƒÆ’Ã¢â‚¬Å¡Ãƒâ€šÃ‚Â¢ÃƒÆ’Ã†â€™Ãƒâ€ Ã¢â‚¬â„¢ÃƒÆ’Ã¢â‚¬Â ÃƒÂ¢Ã¢â€šÂ¬Ã¢â€žÂ¢ÃƒÆ’Ã†â€™ÃƒÂ¢Ã¢â€šÂ¬Ã…Â¡ÃƒÆ’Ã¢â‚¬Å¡Ãƒâ€šÃ‚Â¢ÃƒÆ’Ã†â€™Ãƒâ€ Ã¢â‚¬â„¢ÃƒÆ’Ã¢â‚¬Å¡Ãƒâ€šÃ‚Â¢ÃƒÆ’Ã†â€™Ãƒâ€šÃ‚Â¢ÃƒÆ’Ã‚Â¢ÃƒÂ¢Ã¢â‚¬Å¡Ã‚Â¬Ãƒâ€¦Ã‚Â¡ÃƒÆ’Ã¢â‚¬Å¡Ãƒâ€šÃ‚Â¬ÃƒÆ’Ã†â€™ÃƒÂ¢Ã¢â€šÂ¬Ã‚Â¦ÃƒÆ’Ã¢â‚¬Å¡Ãƒâ€šÃ‚Â¡ÃƒÆ’Ã†â€™Ãƒâ€ Ã¢â‚¬â„¢ÃƒÆ’Ã‚Â¢ÃƒÂ¢Ã¢â‚¬Å¡Ã‚Â¬Ãƒâ€¦Ã‚Â¡ÃƒÆ’Ã†â€™ÃƒÂ¢Ã¢â€šÂ¬Ã…Â¡ÃƒÆ’Ã¢â‚¬Å¡Ãƒâ€šÃ‚Â¬ÃƒÆ’Ã†â€™Ãƒâ€ Ã¢â‚¬â„¢ÃƒÆ’Ã¢â‚¬Â ÃƒÂ¢Ã¢â€šÂ¬Ã¢â€žÂ¢ÃƒÆ’Ã†â€™ÃƒÂ¢Ã¢â€šÂ¬Ã…Â¡ÃƒÆ’Ã¢â‚¬Å¡Ãƒâ€šÃ‚Â¢ÃƒÆ’Ã†â€™Ãƒâ€ Ã¢â‚¬â„¢ÃƒÆ’Ã¢â‚¬Å¡Ãƒâ€šÃ‚Â¢ÃƒÆ’Ã†â€™Ãƒâ€šÃ‚Â¢ÃƒÆ’Ã‚Â¢ÃƒÂ¢Ã¢â€šÂ¬Ã…Â¡Ãƒâ€šÃ‚Â¬ÃƒÆ’Ã¢â‚¬Â¦Ãƒâ€šÃ‚Â¡ÃƒÆ’Ã†â€™ÃƒÂ¢Ã¢â€šÂ¬Ã…Â¡ÃƒÆ’Ã¢â‚¬Å¡Ãƒâ€šÃ‚Â¬ÃƒÆ’Ã†â€™Ãƒâ€ Ã¢â‚¬â„¢ÃƒÆ’Ã‚Â¢ÃƒÂ¢Ã¢â‚¬Å¡Ã‚Â¬Ãƒâ€šÃ‚Â¦ÃƒÆ’Ã†â€™Ãƒâ€šÃ‚Â¢ÃƒÆ’Ã‚Â¢ÃƒÂ¢Ã¢â€šÂ¬Ã…Â¡Ãƒâ€šÃ‚Â¬ÃƒÆ’Ã¢â‚¬Â¦ÃƒÂ¢Ã¢â€šÂ¬Ã…â€œWk6), both systems recovered, with Monoculture reaching a higher peak growth rate (4.872%/day) compared to IMTA (2.246%/day). Overall, although Monoculture showed higher peak SGR values, the IMTA system demonstrated more stable and consistent </w:t>
       </w:r>
       <w:r>
         <w:rPr>
@@ -5421,7 +5421,7 @@
         <w:rPr>
           <w:rFonts w:ascii="Times New Roman" w:hAnsi="Times New Roman" w:cs="Times New Roman"/>
         </w:rPr>
-        <w:t xml:space="preserve"> across three experimental replicates. Overall, the statistical analysis shows no significant difference in weight gain between the replicates, as indicated by the One-Way ANOVA result (p = 0.5416), which is well above the 0.05 significance level. This is further supported by the ÃƒÆ’Ã†â€™Ãƒâ€ Ã¢â‚¬â„¢ÃƒÆ’Ã¢â‚¬Â ÃƒÂ¢Ã¢â€šÂ¬Ã¢â€žÂ¢ÃƒÆ’Ã†â€™ÃƒÂ¢Ã¢â€šÂ¬Ã…Â¡ÃƒÆ’Ã¢â‚¬Å¡Ãƒâ€šÃ‚Â¢ÃƒÆ’Ã†â€™Ãƒâ€ Ã¢â‚¬â„¢ÃƒÆ’Ã¢â‚¬Å¡Ãƒâ€šÃ‚Â¢ÃƒÆ’Ã†â€™Ãƒâ€šÃ‚Â¢ÃƒÆ’Ã‚Â¢ÃƒÂ¢Ã¢â€šÂ¬Ã…Â¡Ãƒâ€šÃ‚Â¬ÃƒÆ’Ã¢â‚¬Â¦Ãƒâ€šÃ‚Â¡ÃƒÆ’Ã†â€™ÃƒÂ¢Ã¢â€šÂ¬Ã…Â¡ÃƒÆ’Ã¢â‚¬Å¡Ãƒâ€šÃ‚Â¬ÃƒÆ’Ã†â€™Ãƒâ€ Ã¢â‚¬â„¢ÃƒÆ’Ã‚Â¢ÃƒÂ¢Ã¢â‚¬Å¡Ã‚Â¬Ãƒâ€šÃ‚Â¦ÃƒÆ’Ã†â€™Ãƒâ€šÃ‚Â¢ÃƒÆ’Ã‚Â¢ÃƒÂ¢Ã¢â€šÂ¬Ã…Â¡Ãƒâ€šÃ‚Â¬ÃƒÆ’Ã¢â‚¬Â¦ÃƒÂ¢Ã¢â€šÂ¬Ã…â€œnsÃƒÆ’Ã†â€™Ãƒâ€ Ã¢â‚¬â„¢ÃƒÆ’Ã¢â‚¬Â ÃƒÂ¢Ã¢â€šÂ¬Ã¢â€žÂ¢ÃƒÆ’Ã†â€™ÃƒÂ¢Ã¢â€šÂ¬Ã…Â¡ÃƒÆ’Ã¢â‚¬Å¡Ãƒâ€šÃ‚Â¢ÃƒÆ’Ã†â€™Ãƒâ€ Ã¢â‚¬â„¢ÃƒÆ’Ã¢â‚¬Å¡Ãƒâ€šÃ‚Â¢ÃƒÆ’Ã†â€™Ãƒâ€šÃ‚Â¢ÃƒÆ’Ã‚Â¢ÃƒÂ¢Ã¢â€šÂ¬Ã…Â¡Ãƒâ€šÃ‚Â¬ÃƒÆ’Ã¢â‚¬Â¦Ãƒâ€šÃ‚Â¡ÃƒÆ’Ã†â€™ÃƒÂ¢Ã¢â€šÂ¬Ã…Â¡ÃƒÆ’Ã¢â‚¬Å¡Ãƒâ€šÃ‚Â¬ÃƒÆ’Ã†â€™Ãƒâ€ Ã¢â‚¬â„¢ÃƒÆ’Ã‚Â¢ÃƒÂ¢Ã¢â‚¬Å¡Ã‚Â¬Ãƒâ€¦Ã‚Â¡ÃƒÆ’Ã†â€™ÃƒÂ¢Ã¢â€šÂ¬Ã…Â¡ÃƒÆ’Ã¢â‚¬Å¡Ãƒâ€šÃ‚Â (non-significant) labels in the pairwise comparisons, confirming that none of the replicates differed meaningfully from each other.</w:t>
+        <w:t xml:space="preserve"> across three experimental replicates. Overall, the statistical analysis shows no significant difference in weight gain between the replicates, as indicated by the One-Way ANOVA result (p = 0.5416), which is well above the 0.05 significance level. This is further supported by the ÃƒÆ’Ã†â€™Ãƒâ€ Ã¢â‚¬â„¢ÃƒÆ’Ã¢â‚¬Â ÃƒÂ¢Ã¢â€šÂ¬Ã¢â€žÂ¢ÃƒÆ’Ã†â€™ÃƒÂ¢Ã¢â€šÂ¬Ã‚Â ÃƒÆ’Ã‚Â¢ÃƒÂ¢Ã¢â‚¬Å¡Ã‚Â¬ÃƒÂ¢Ã¢â‚¬Å¾Ã‚Â¢ÃƒÆ’Ã†â€™Ãƒâ€ Ã¢â‚¬â„¢ÃƒÆ’Ã‚Â¢ÃƒÂ¢Ã¢â‚¬Å¡Ã‚Â¬Ãƒâ€¦Ã‚Â¡ÃƒÆ’Ã†â€™ÃƒÂ¢Ã¢â€šÂ¬Ã…Â¡ÃƒÆ’Ã¢â‚¬Å¡Ãƒâ€šÃ‚Â¢ÃƒÆ’Ã†â€™Ãƒâ€ Ã¢â‚¬â„¢ÃƒÆ’Ã¢â‚¬Â ÃƒÂ¢Ã¢â€šÂ¬Ã¢â€žÂ¢ÃƒÆ’Ã†â€™ÃƒÂ¢Ã¢â€šÂ¬Ã…Â¡ÃƒÆ’Ã¢â‚¬Å¡Ãƒâ€šÃ‚Â¢ÃƒÆ’Ã†â€™Ãƒâ€ Ã¢â‚¬â„¢ÃƒÆ’Ã¢â‚¬Å¡Ãƒâ€šÃ‚Â¢ÃƒÆ’Ã†â€™Ãƒâ€šÃ‚Â¢ÃƒÆ’Ã‚Â¢ÃƒÂ¢Ã¢â‚¬Å¡Ã‚Â¬Ãƒâ€¦Ã‚Â¡ÃƒÆ’Ã¢â‚¬Å¡Ãƒâ€šÃ‚Â¬ÃƒÆ’Ã†â€™ÃƒÂ¢Ã¢â€šÂ¬Ã‚Â¦ÃƒÆ’Ã¢â‚¬Å¡Ãƒâ€šÃ‚Â¡ÃƒÆ’Ã†â€™Ãƒâ€ Ã¢â‚¬â„¢ÃƒÆ’Ã‚Â¢ÃƒÂ¢Ã¢â‚¬Å¡Ã‚Â¬Ãƒâ€¦Ã‚Â¡ÃƒÆ’Ã†â€™ÃƒÂ¢Ã¢â€šÂ¬Ã…Â¡ÃƒÆ’Ã¢â‚¬Å¡Ãƒâ€šÃ‚Â¬ÃƒÆ’Ã†â€™Ãƒâ€ Ã¢â‚¬â„¢ÃƒÆ’Ã¢â‚¬Â ÃƒÂ¢Ã¢â€šÂ¬Ã¢â€žÂ¢ÃƒÆ’Ã†â€™Ãƒâ€šÃ‚Â¢ÃƒÆ’Ã‚Â¢ÃƒÂ¢Ã¢â€šÂ¬Ã…Â¡Ãƒâ€šÃ‚Â¬ÃƒÆ’Ã¢â‚¬Å¡Ãƒâ€šÃ‚Â¦ÃƒÆ’Ã†â€™Ãƒâ€ Ã¢â‚¬â„¢ÃƒÆ’Ã¢â‚¬Å¡Ãƒâ€šÃ‚Â¢ÃƒÆ’Ã†â€™Ãƒâ€šÃ‚Â¢ÃƒÆ’Ã‚Â¢ÃƒÂ¢Ã¢â‚¬Å¡Ã‚Â¬Ãƒâ€¦Ã‚Â¡ÃƒÆ’Ã¢â‚¬Å¡Ãƒâ€šÃ‚Â¬ÃƒÆ’Ã†â€™ÃƒÂ¢Ã¢â€šÂ¬Ã‚Â¦ÃƒÆ’Ã‚Â¢ÃƒÂ¢Ã¢â‚¬Å¡Ã‚Â¬Ãƒâ€¦Ã¢â‚¬Å“nsÃƒÆ’Ã†â€™Ãƒâ€ Ã¢â‚¬â„¢ÃƒÆ’Ã¢â‚¬Â ÃƒÂ¢Ã¢â€šÂ¬Ã¢â€žÂ¢ÃƒÆ’Ã†â€™ÃƒÂ¢Ã¢â€šÂ¬Ã‚Â ÃƒÆ’Ã‚Â¢ÃƒÂ¢Ã¢â‚¬Å¡Ã‚Â¬ÃƒÂ¢Ã¢â‚¬Å¾Ã‚Â¢ÃƒÆ’Ã†â€™Ãƒâ€ Ã¢â‚¬â„¢ÃƒÆ’Ã‚Â¢ÃƒÂ¢Ã¢â‚¬Å¡Ã‚Â¬Ãƒâ€¦Ã‚Â¡ÃƒÆ’Ã†â€™ÃƒÂ¢Ã¢â€šÂ¬Ã…Â¡ÃƒÆ’Ã¢â‚¬Å¡Ãƒâ€šÃ‚Â¢ÃƒÆ’Ã†â€™Ãƒâ€ Ã¢â‚¬â„¢ÃƒÆ’Ã¢â‚¬Â ÃƒÂ¢Ã¢â€šÂ¬Ã¢â€žÂ¢ÃƒÆ’Ã†â€™ÃƒÂ¢Ã¢â€šÂ¬Ã…Â¡ÃƒÆ’Ã¢â‚¬Å¡Ãƒâ€šÃ‚Â¢ÃƒÆ’Ã†â€™Ãƒâ€ Ã¢â‚¬â„¢ÃƒÆ’Ã¢â‚¬Å¡Ãƒâ€šÃ‚Â¢ÃƒÆ’Ã†â€™Ãƒâ€šÃ‚Â¢ÃƒÆ’Ã‚Â¢ÃƒÂ¢Ã¢â‚¬Å¡Ã‚Â¬Ãƒâ€¦Ã‚Â¡ÃƒÆ’Ã¢â‚¬Å¡Ãƒâ€šÃ‚Â¬ÃƒÆ’Ã†â€™ÃƒÂ¢Ã¢â€šÂ¬Ã‚Â¦ÃƒÆ’Ã¢â‚¬Å¡Ãƒâ€šÃ‚Â¡ÃƒÆ’Ã†â€™Ãƒâ€ Ã¢â‚¬â„¢ÃƒÆ’Ã‚Â¢ÃƒÂ¢Ã¢â‚¬Å¡Ã‚Â¬Ãƒâ€¦Ã‚Â¡ÃƒÆ’Ã†â€™ÃƒÂ¢Ã¢â€šÂ¬Ã…Â¡ÃƒÆ’Ã¢â‚¬Å¡Ãƒâ€šÃ‚Â¬ÃƒÆ’Ã†â€™Ãƒâ€ Ã¢â‚¬â„¢ÃƒÆ’Ã¢â‚¬Â ÃƒÂ¢Ã¢â€šÂ¬Ã¢â€žÂ¢ÃƒÆ’Ã†â€™Ãƒâ€šÃ‚Â¢ÃƒÆ’Ã‚Â¢ÃƒÂ¢Ã¢â€šÂ¬Ã…Â¡Ãƒâ€šÃ‚Â¬ÃƒÆ’Ã¢â‚¬Â¦Ãƒâ€šÃ‚Â¡ÃƒÆ’Ã†â€™Ãƒâ€ Ã¢â‚¬â„¢ÃƒÆ’Ã‚Â¢ÃƒÂ¢Ã¢â‚¬Å¡Ã‚Â¬Ãƒâ€¦Ã‚Â¡ÃƒÆ’Ã†â€™ÃƒÂ¢Ã¢â€šÂ¬Ã…Â¡ÃƒÆ’Ã¢â‚¬Å¡Ãƒâ€šÃ‚Â (non-significant) labels in the pairwise comparisons, confirming that none of the replicates differed meaningfully from each other.</w:t>
       </w:r>
     </w:p>
     <w:p>
@@ -6279,7 +6279,7 @@
         <w:rPr>
           <w:rFonts w:ascii="Times New Roman" w:hAnsi="Times New Roman" w:cs="Times New Roman"/>
         </w:rPr>
-        <w:t>The line graph illustrates the weekly changes in Total Dissolved Solids (TDS), measured in parts per thousand (ppt), for Integrated Multi-Trophic Aquaculture (IMTA) and Monoculture treatments over a seven-week period. At the beginning of the study (Week 1), both treatments recorded identical TDS levels of approximately 16.5 ppt. During the early phase (Weeks 2ÃƒÆ’Ã†â€™Ãƒâ€ Ã¢â‚¬â„¢ÃƒÆ’Ã¢â‚¬Â ÃƒÂ¢Ã¢â€šÂ¬Ã¢â€žÂ¢ÃƒÆ’Ã†â€™ÃƒÂ¢Ã¢â€šÂ¬Ã…Â¡ÃƒÆ’Ã¢â‚¬Å¡Ãƒâ€šÃ‚Â¢ÃƒÆ’Ã†â€™Ãƒâ€ Ã¢â‚¬â„¢ÃƒÆ’Ã¢â‚¬Å¡Ãƒâ€šÃ‚Â¢ÃƒÆ’Ã†â€™Ãƒâ€šÃ‚Â¢ÃƒÆ’Ã‚Â¢ÃƒÂ¢Ã¢â€šÂ¬Ã…Â¡Ãƒâ€šÃ‚Â¬ÃƒÆ’Ã¢â‚¬Â¦Ãƒâ€šÃ‚Â¡ÃƒÆ’Ã†â€™ÃƒÂ¢Ã¢â€šÂ¬Ã…Â¡ÃƒÆ’Ã¢â‚¬Å¡Ãƒâ€šÃ‚Â¬ÃƒÆ’Ã†â€™Ãƒâ€ Ã¢â‚¬â„¢ÃƒÆ’Ã¢â‚¬Å¡Ãƒâ€šÃ‚Â¢ÃƒÆ’Ã†â€™Ãƒâ€šÃ‚Â¢ÃƒÆ’Ã‚Â¢ÃƒÂ¢Ã¢â‚¬Å¡Ã‚Â¬Ãƒâ€¦Ã‚Â¡ÃƒÆ’Ã¢â‚¬Å¡Ãƒâ€šÃ‚Â¬ÃƒÆ’Ã†â€™ÃƒÂ¢Ã¢â€šÂ¬Ã‚Â¦ÃƒÆ’Ã‚Â¢ÃƒÂ¢Ã¢â‚¬Å¡Ã‚Â¬Ãƒâ€¦Ã¢â‚¬Å“3), TDS levels increased in both systems, with the Monoculture treatment showing slightly higher values (around 18.6 ppt) compared to the IMTA system (approximately 18.1 ppt).</w:t>
+        <w:t>The line graph illustrates the weekly changes in Total Dissolved Solids (TDS), measured in parts per thousand (ppt), for Integrated Multi-Trophic Aquaculture (IMTA) and Monoculture treatments over a seven-week period. At the beginning of the study (Week 1), both treatments recorded identical TDS levels of approximately 16.5 ppt. During the early phase (Weeks 2ÃƒÆ’Ã†â€™Ãƒâ€ Ã¢â‚¬â„¢ÃƒÆ’Ã¢â‚¬Â ÃƒÂ¢Ã¢â€šÂ¬Ã¢â€žÂ¢ÃƒÆ’Ã†â€™ÃƒÂ¢Ã¢â€šÂ¬Ã‚Â ÃƒÆ’Ã‚Â¢ÃƒÂ¢Ã¢â‚¬Å¡Ã‚Â¬ÃƒÂ¢Ã¢â‚¬Å¾Ã‚Â¢ÃƒÆ’Ã†â€™Ãƒâ€ Ã¢â‚¬â„¢ÃƒÆ’Ã‚Â¢ÃƒÂ¢Ã¢â‚¬Å¡Ã‚Â¬Ãƒâ€¦Ã‚Â¡ÃƒÆ’Ã†â€™ÃƒÂ¢Ã¢â€šÂ¬Ã…Â¡ÃƒÆ’Ã¢â‚¬Å¡Ãƒâ€šÃ‚Â¢ÃƒÆ’Ã†â€™Ãƒâ€ Ã¢â‚¬â„¢ÃƒÆ’Ã¢â‚¬Â ÃƒÂ¢Ã¢â€šÂ¬Ã¢â€žÂ¢ÃƒÆ’Ã†â€™ÃƒÂ¢Ã¢â€šÂ¬Ã…Â¡ÃƒÆ’Ã¢â‚¬Å¡Ãƒâ€šÃ‚Â¢ÃƒÆ’Ã†â€™Ãƒâ€ Ã¢â‚¬â„¢ÃƒÆ’Ã¢â‚¬Å¡Ãƒâ€šÃ‚Â¢ÃƒÆ’Ã†â€™Ãƒâ€šÃ‚Â¢ÃƒÆ’Ã‚Â¢ÃƒÂ¢Ã¢â‚¬Å¡Ã‚Â¬Ãƒâ€¦Ã‚Â¡ÃƒÆ’Ã¢â‚¬Å¡Ãƒâ€šÃ‚Â¬ÃƒÆ’Ã†â€™ÃƒÂ¢Ã¢â€šÂ¬Ã‚Â¦ÃƒÆ’Ã¢â‚¬Å¡Ãƒâ€šÃ‚Â¡ÃƒÆ’Ã†â€™Ãƒâ€ Ã¢â‚¬â„¢ÃƒÆ’Ã‚Â¢ÃƒÂ¢Ã¢â‚¬Å¡Ã‚Â¬Ãƒâ€¦Ã‚Â¡ÃƒÆ’Ã†â€™ÃƒÂ¢Ã¢â€šÂ¬Ã…Â¡ÃƒÆ’Ã¢â‚¬Å¡Ãƒâ€šÃ‚Â¬ÃƒÆ’Ã†â€™Ãƒâ€ Ã¢â‚¬â„¢ÃƒÆ’Ã¢â‚¬Â ÃƒÂ¢Ã¢â€šÂ¬Ã¢â€žÂ¢ÃƒÆ’Ã†â€™ÃƒÂ¢Ã¢â€šÂ¬Ã…Â¡ÃƒÆ’Ã¢â‚¬Å¡Ãƒâ€šÃ‚Â¢ÃƒÆ’Ã†â€™Ãƒâ€ Ã¢â‚¬â„¢ÃƒÆ’Ã¢â‚¬Å¡Ãƒâ€šÃ‚Â¢ÃƒÆ’Ã†â€™Ãƒâ€šÃ‚Â¢ÃƒÆ’Ã‚Â¢ÃƒÂ¢Ã¢â€šÂ¬Ã…Â¡Ãƒâ€šÃ‚Â¬ÃƒÆ’Ã¢â‚¬Â¦Ãƒâ€šÃ‚Â¡ÃƒÆ’Ã†â€™ÃƒÂ¢Ã¢â€šÂ¬Ã…Â¡ÃƒÆ’Ã¢â‚¬Å¡Ãƒâ€šÃ‚Â¬ÃƒÆ’Ã†â€™Ãƒâ€ Ã¢â‚¬â„¢ÃƒÆ’Ã‚Â¢ÃƒÂ¢Ã¢â‚¬Å¡Ã‚Â¬Ãƒâ€šÃ‚Â¦ÃƒÆ’Ã†â€™Ãƒâ€šÃ‚Â¢ÃƒÆ’Ã‚Â¢ÃƒÂ¢Ã¢â€šÂ¬Ã…Â¡Ãƒâ€šÃ‚Â¬ÃƒÆ’Ã¢â‚¬Â¦ÃƒÂ¢Ã¢â€šÂ¬Ã…â€œ3), TDS levels increased in both systems, with the Monoculture treatment showing slightly higher values (around 18.6 ppt) compared to the IMTA system (approximately 18.1 ppt).</w:t>
       </w:r>
     </w:p>
     <w:p>
@@ -6525,21 +6525,21 @@
         <w:rPr>
           <w:rFonts w:ascii="Times New Roman" w:hAnsi="Times New Roman" w:cs="Times New Roman"/>
         </w:rPr>
-        <w:t>The line graph illustrates the weekly changes in salinity levels (measured in ppt) for Integrated Multi-Trophic Aquaculture (IMTA) and Monoculture treatments over a seven-week period. At the start of the study (Week 1), both treatments recorded identical salinity levels of approximately 20.6 ppt. During the early phase (Weeks 2ÃƒÆ’Ã†â€™Ãƒâ€ Ã¢â‚¬â„¢ÃƒÆ’Ã¢â‚¬Â ÃƒÂ¢Ã¢â€šÂ¬Ã¢â€žÂ¢ÃƒÆ’Ã†â€™ÃƒÂ¢Ã¢â€šÂ¬Ã…Â¡ÃƒÆ’Ã¢â‚¬Å¡Ãƒâ€šÃ‚Â¢ÃƒÆ’Ã†â€™Ãƒâ€ Ã¢â‚¬â„¢ÃƒÆ’Ã¢â‚¬Å¡Ãƒâ€šÃ‚Â¢ÃƒÆ’Ã†â€™Ãƒâ€šÃ‚Â¢ÃƒÆ’Ã‚Â¢ÃƒÂ¢Ã¢â€šÂ¬Ã…Â¡Ãƒâ€šÃ‚Â¬ÃƒÆ’Ã¢â‚¬Â¦Ãƒâ€šÃ‚Â¡ÃƒÆ’Ã†â€™ÃƒÂ¢Ã¢â€šÂ¬Ã…Â¡ÃƒÆ’Ã¢â‚¬Å¡Ãƒâ€šÃ‚Â¬ÃƒÆ’Ã†â€™Ãƒâ€ Ã¢â‚¬â„¢ÃƒÆ’Ã¢â‚¬Å¡Ãƒâ€šÃ‚Â¢ÃƒÆ’Ã†â€™Ãƒâ€šÃ‚Â¢ÃƒÆ’Ã‚Â¢ÃƒÂ¢Ã¢â‚¬Å¡Ã‚Â¬Ãƒâ€¦Ã‚Â¡ÃƒÆ’Ã¢â‚¬Å¡Ãƒâ€šÃ‚Â¬ÃƒÆ’Ã†â€™ÃƒÂ¢Ã¢â€šÂ¬Ã‚Â¦ÃƒÆ’Ã‚Â¢ÃƒÂ¢Ã¢â‚¬Å¡Ã‚Â¬Ãƒâ€¦Ã¢â‚¬Å“3), salinity increased in both systems; however, the Monoculture treatment consistently showed higher values (around 23.5 ppt) compared to the IMTA system (approximately 22.9 ppt).</w:t>
-      </w:r>
-    </w:p>
-    <w:p>
-      <w:pPr>
-        <w:spacing w:line="360" w:lineRule="auto"/>
-        <w:rPr>
-          <w:rFonts w:ascii="Times New Roman" w:hAnsi="Times New Roman" w:cs="Times New Roman"/>
-        </w:rPr>
-      </w:pPr>
-      <w:r>
-        <w:rPr>
-          <w:rFonts w:ascii="Times New Roman" w:hAnsi="Times New Roman" w:cs="Times New Roman"/>
-        </w:rPr>
-        <w:t xml:space="preserve">In the mid-phase of the study (Weeks 4ÃƒÆ’Ã†â€™Ãƒâ€ Ã¢â‚¬â„¢ÃƒÆ’Ã¢â‚¬Â ÃƒÂ¢Ã¢â€šÂ¬Ã¢â€žÂ¢ÃƒÆ’Ã†â€™ÃƒÂ¢Ã¢â€šÂ¬Ã…Â¡ÃƒÆ’Ã¢â‚¬Å¡Ãƒâ€šÃ‚Â¢ÃƒÆ’Ã†â€™Ãƒâ€ Ã¢â‚¬â„¢ÃƒÆ’Ã¢â‚¬Å¡Ãƒâ€šÃ‚Â¢ÃƒÆ’Ã†â€™Ãƒâ€šÃ‚Â¢ÃƒÆ’Ã‚Â¢ÃƒÂ¢Ã¢â€šÂ¬Ã…Â¡Ãƒâ€šÃ‚Â¬ÃƒÆ’Ã¢â‚¬Â¦Ãƒâ€šÃ‚Â¡ÃƒÆ’Ã†â€™ÃƒÂ¢Ã¢â€šÂ¬Ã…Â¡ÃƒÆ’Ã¢â‚¬Å¡Ãƒâ€šÃ‚Â¬ÃƒÆ’Ã†â€™Ãƒâ€ Ã¢â‚¬â„¢ÃƒÆ’Ã¢â‚¬Å¡Ãƒâ€šÃ‚Â¢ÃƒÆ’Ã†â€™Ãƒâ€šÃ‚Â¢ÃƒÆ’Ã‚Â¢ÃƒÂ¢Ã¢â‚¬Å¡Ã‚Â¬Ãƒâ€¦Ã‚Â¡ÃƒÆ’Ã¢â‚¬Å¡Ãƒâ€šÃ‚Â¬ÃƒÆ’Ã†â€™ÃƒÂ¢Ã¢â€šÂ¬Ã‚Â¦ÃƒÆ’Ã‚Â¢ÃƒÂ¢Ã¢â‚¬Å¡Ã‚Â¬Ãƒâ€¦Ã¢â‚¬Å“5), the salinity levels of both treatments briefly converged at about 21.5 ppt in Week 4. This was followed by a notable divergence in Week 5, where Monoculture salinity increased sharply to approximately 24.0 ppt, while the IMTA system </w:t>
+        <w:t>The line graph illustrates the weekly changes in salinity levels (measured in ppt) for Integrated Multi-Trophic Aquaculture (IMTA) and Monoculture treatments over a seven-week period. At the start of the study (Week 1), both treatments recorded identical salinity levels of approximately 20.6 ppt. During the early phase (Weeks 2ÃƒÆ’Ã†â€™Ãƒâ€ Ã¢â‚¬â„¢ÃƒÆ’Ã¢â‚¬Â ÃƒÂ¢Ã¢â€šÂ¬Ã¢â€žÂ¢ÃƒÆ’Ã†â€™ÃƒÂ¢Ã¢â€šÂ¬Ã‚Â ÃƒÆ’Ã‚Â¢ÃƒÂ¢Ã¢â‚¬Å¡Ã‚Â¬ÃƒÂ¢Ã¢â‚¬Å¾Ã‚Â¢ÃƒÆ’Ã†â€™Ãƒâ€ Ã¢â‚¬â„¢ÃƒÆ’Ã‚Â¢ÃƒÂ¢Ã¢â‚¬Å¡Ã‚Â¬Ãƒâ€¦Ã‚Â¡ÃƒÆ’Ã†â€™ÃƒÂ¢Ã¢â€šÂ¬Ã…Â¡ÃƒÆ’Ã¢â‚¬Å¡Ãƒâ€šÃ‚Â¢ÃƒÆ’Ã†â€™Ãƒâ€ Ã¢â‚¬â„¢ÃƒÆ’Ã¢â‚¬Â ÃƒÂ¢Ã¢â€šÂ¬Ã¢â€žÂ¢ÃƒÆ’Ã†â€™ÃƒÂ¢Ã¢â€šÂ¬Ã…Â¡ÃƒÆ’Ã¢â‚¬Å¡Ãƒâ€šÃ‚Â¢ÃƒÆ’Ã†â€™Ãƒâ€ Ã¢â‚¬â„¢ÃƒÆ’Ã¢â‚¬Å¡Ãƒâ€šÃ‚Â¢ÃƒÆ’Ã†â€™Ãƒâ€šÃ‚Â¢ÃƒÆ’Ã‚Â¢ÃƒÂ¢Ã¢â‚¬Å¡Ã‚Â¬Ãƒâ€¦Ã‚Â¡ÃƒÆ’Ã¢â‚¬Å¡Ãƒâ€šÃ‚Â¬ÃƒÆ’Ã†â€™ÃƒÂ¢Ã¢â€šÂ¬Ã‚Â¦ÃƒÆ’Ã¢â‚¬Å¡Ãƒâ€šÃ‚Â¡ÃƒÆ’Ã†â€™Ãƒâ€ Ã¢â‚¬â„¢ÃƒÆ’Ã‚Â¢ÃƒÂ¢Ã¢â‚¬Å¡Ã‚Â¬Ãƒâ€¦Ã‚Â¡ÃƒÆ’Ã†â€™ÃƒÂ¢Ã¢â€šÂ¬Ã…Â¡ÃƒÆ’Ã¢â‚¬Å¡Ãƒâ€šÃ‚Â¬ÃƒÆ’Ã†â€™Ãƒâ€ Ã¢â‚¬â„¢ÃƒÆ’Ã¢â‚¬Â ÃƒÂ¢Ã¢â€šÂ¬Ã¢â€žÂ¢ÃƒÆ’Ã†â€™ÃƒÂ¢Ã¢â€šÂ¬Ã…Â¡ÃƒÆ’Ã¢â‚¬Å¡Ãƒâ€šÃ‚Â¢ÃƒÆ’Ã†â€™Ãƒâ€ Ã¢â‚¬â„¢ÃƒÆ’Ã¢â‚¬Å¡Ãƒâ€šÃ‚Â¢ÃƒÆ’Ã†â€™Ãƒâ€šÃ‚Â¢ÃƒÆ’Ã‚Â¢ÃƒÂ¢Ã¢â€šÂ¬Ã…Â¡Ãƒâ€šÃ‚Â¬ÃƒÆ’Ã¢â‚¬Â¦Ãƒâ€šÃ‚Â¡ÃƒÆ’Ã†â€™ÃƒÂ¢Ã¢â€šÂ¬Ã…Â¡ÃƒÆ’Ã¢â‚¬Å¡Ãƒâ€šÃ‚Â¬ÃƒÆ’Ã†â€™Ãƒâ€ Ã¢â‚¬â„¢ÃƒÆ’Ã‚Â¢ÃƒÂ¢Ã¢â‚¬Å¡Ã‚Â¬Ãƒâ€šÃ‚Â¦ÃƒÆ’Ã†â€™Ãƒâ€šÃ‚Â¢ÃƒÆ’Ã‚Â¢ÃƒÂ¢Ã¢â€šÂ¬Ã…Â¡Ãƒâ€šÃ‚Â¬ÃƒÆ’Ã¢â‚¬Â¦ÃƒÂ¢Ã¢â€šÂ¬Ã…â€œ3), salinity increased in both systems; however, the Monoculture treatment consistently showed higher values (around 23.5 ppt) compared to the IMTA system (approximately 22.9 ppt).</w:t>
+      </w:r>
+    </w:p>
+    <w:p>
+      <w:pPr>
+        <w:spacing w:line="360" w:lineRule="auto"/>
+        <w:rPr>
+          <w:rFonts w:ascii="Times New Roman" w:hAnsi="Times New Roman" w:cs="Times New Roman"/>
+        </w:rPr>
+      </w:pPr>
+      <w:r>
+        <w:rPr>
+          <w:rFonts w:ascii="Times New Roman" w:hAnsi="Times New Roman" w:cs="Times New Roman"/>
+        </w:rPr>
+        <w:t xml:space="preserve">In the mid-phase of the study (Weeks 4ÃƒÆ’Ã†â€™Ãƒâ€ Ã¢â‚¬â„¢ÃƒÆ’Ã¢â‚¬Â ÃƒÂ¢Ã¢â€šÂ¬Ã¢â€žÂ¢ÃƒÆ’Ã†â€™ÃƒÂ¢Ã¢â€šÂ¬Ã‚Â ÃƒÆ’Ã‚Â¢ÃƒÂ¢Ã¢â‚¬Å¡Ã‚Â¬ÃƒÂ¢Ã¢â‚¬Å¾Ã‚Â¢ÃƒÆ’Ã†â€™Ãƒâ€ Ã¢â‚¬â„¢ÃƒÆ’Ã‚Â¢ÃƒÂ¢Ã¢â‚¬Å¡Ã‚Â¬Ãƒâ€¦Ã‚Â¡ÃƒÆ’Ã†â€™ÃƒÂ¢Ã¢â€šÂ¬Ã…Â¡ÃƒÆ’Ã¢â‚¬Å¡Ãƒâ€šÃ‚Â¢ÃƒÆ’Ã†â€™Ãƒâ€ Ã¢â‚¬â„¢ÃƒÆ’Ã¢â‚¬Â ÃƒÂ¢Ã¢â€šÂ¬Ã¢â€žÂ¢ÃƒÆ’Ã†â€™ÃƒÂ¢Ã¢â€šÂ¬Ã…Â¡ÃƒÆ’Ã¢â‚¬Å¡Ãƒâ€šÃ‚Â¢ÃƒÆ’Ã†â€™Ãƒâ€ Ã¢â‚¬â„¢ÃƒÆ’Ã¢â‚¬Å¡Ãƒâ€šÃ‚Â¢ÃƒÆ’Ã†â€™Ãƒâ€šÃ‚Â¢ÃƒÆ’Ã‚Â¢ÃƒÂ¢Ã¢â‚¬Å¡Ã‚Â¬Ãƒâ€¦Ã‚Â¡ÃƒÆ’Ã¢â‚¬Å¡Ãƒâ€šÃ‚Â¬ÃƒÆ’Ã†â€™ÃƒÂ¢Ã¢â€šÂ¬Ã‚Â¦ÃƒÆ’Ã¢â‚¬Å¡Ãƒâ€šÃ‚Â¡ÃƒÆ’Ã†â€™Ãƒâ€ Ã¢â‚¬â„¢ÃƒÆ’Ã‚Â¢ÃƒÂ¢Ã¢â‚¬Å¡Ã‚Â¬Ãƒâ€¦Ã‚Â¡ÃƒÆ’Ã†â€™ÃƒÂ¢Ã¢â€šÂ¬Ã…Â¡ÃƒÆ’Ã¢â‚¬Å¡Ãƒâ€šÃ‚Â¬ÃƒÆ’Ã†â€™Ãƒâ€ Ã¢â‚¬â„¢ÃƒÆ’Ã¢â‚¬Â ÃƒÂ¢Ã¢â€šÂ¬Ã¢â€žÂ¢ÃƒÆ’Ã†â€™ÃƒÂ¢Ã¢â€šÂ¬Ã…Â¡ÃƒÆ’Ã¢â‚¬Å¡Ãƒâ€šÃ‚Â¢ÃƒÆ’Ã†â€™Ãƒâ€ Ã¢â‚¬â„¢ÃƒÆ’Ã¢â‚¬Å¡Ãƒâ€šÃ‚Â¢ÃƒÆ’Ã†â€™Ãƒâ€šÃ‚Â¢ÃƒÆ’Ã‚Â¢ÃƒÂ¢Ã¢â€šÂ¬Ã…Â¡Ãƒâ€šÃ‚Â¬ÃƒÆ’Ã¢â‚¬Â¦Ãƒâ€šÃ‚Â¡ÃƒÆ’Ã†â€™ÃƒÂ¢Ã¢â€šÂ¬Ã…Â¡ÃƒÆ’Ã¢â‚¬Å¡Ãƒâ€šÃ‚Â¬ÃƒÆ’Ã†â€™Ãƒâ€ Ã¢â‚¬â„¢ÃƒÆ’Ã‚Â¢ÃƒÂ¢Ã¢â‚¬Å¡Ã‚Â¬Ãƒâ€šÃ‚Â¦ÃƒÆ’Ã†â€™Ãƒâ€šÃ‚Â¢ÃƒÆ’Ã‚Â¢ÃƒÂ¢Ã¢â€šÂ¬Ã…Â¡Ãƒâ€šÃ‚Â¬ÃƒÆ’Ã¢â‚¬Â¦ÃƒÂ¢Ã¢â€šÂ¬Ã…â€œ5), the salinity levels of both treatments briefly converged at about 21.5 ppt in Week 4. This was followed by a notable divergence in Week 5, where Monoculture salinity increased sharply to approximately 24.0 ppt, while the IMTA system </w:t>
       </w:r>
       <w:r>
         <w:rPr>
@@ -6923,7 +6923,7 @@
         <w:rPr>
           <w:rFonts w:ascii="Times New Roman" w:hAnsi="Times New Roman" w:cs="Times New Roman"/>
         </w:rPr>
-        <w:t>The line graph illustrates the weekly variation in water temperature (ÃƒÆ’Ã†â€™Ãƒâ€ Ã¢â‚¬â„¢ÃƒÆ’Ã¢â‚¬Â ÃƒÂ¢Ã¢â€šÂ¬Ã¢â€žÂ¢ÃƒÆ’Ã†â€™Ãƒâ€šÃ‚Â¢ÃƒÆ’Ã‚Â¢ÃƒÂ¢Ã¢â€šÂ¬Ã…Â¡Ãƒâ€šÃ‚Â¬ÃƒÆ’Ã¢â‚¬Â¦Ãƒâ€šÃ‚Â¡ÃƒÆ’Ã†â€™Ãƒâ€ Ã¢â‚¬â„¢ÃƒÆ’Ã‚Â¢ÃƒÂ¢Ã¢â‚¬Å¡Ã‚Â¬Ãƒâ€¦Ã‚Â¡ÃƒÆ’Ã†â€™ÃƒÂ¢Ã¢â€šÂ¬Ã…Â¡ÃƒÆ’Ã¢â‚¬Å¡Ãƒâ€šÃ‚Â°C) in two aquaculture systems, Integrated Multi-Trophic Aquaculture (IMTA) and Monoculture, over a seven-week period. Overall, both treatments exhibited a very similar pattern of fluctuation throughout the study. At the beginning (Week 1), water temperature was relatively high in both systems, with Monoculture showing a slightly higher value (approximately 28.7ÃƒÆ’Ã†â€™Ãƒâ€ Ã¢â‚¬â„¢ÃƒÆ’Ã¢â‚¬Â ÃƒÂ¢Ã¢â€šÂ¬Ã¢â€žÂ¢ÃƒÆ’Ã†â€™Ãƒâ€šÃ‚Â¢ÃƒÆ’Ã‚Â¢ÃƒÂ¢Ã¢â€šÂ¬Ã…Â¡Ãƒâ€šÃ‚Â¬ÃƒÆ’Ã¢â‚¬Â¦Ãƒâ€šÃ‚Â¡ÃƒÆ’Ã†â€™Ãƒâ€ Ã¢â‚¬â„¢ÃƒÆ’Ã‚Â¢ÃƒÂ¢Ã¢â‚¬Å¡Ã‚Â¬Ãƒâ€¦Ã‚Â¡ÃƒÆ’Ã†â€™ÃƒÂ¢Ã¢â€šÂ¬Ã…Â¡ÃƒÆ’Ã¢â‚¬Å¡Ãƒâ€šÃ‚Â°C) compared to IMTA (around 28.2ÃƒÆ’Ã†â€™Ãƒâ€ Ã¢â‚¬â„¢ÃƒÆ’Ã¢â‚¬Â ÃƒÂ¢Ã¢â€šÂ¬Ã¢â€žÂ¢ÃƒÆ’Ã†â€™Ãƒâ€šÃ‚Â¢ÃƒÆ’Ã‚Â¢ÃƒÂ¢Ã¢â€šÂ¬Ã…Â¡Ãƒâ€šÃ‚Â¬ÃƒÆ’Ã¢â‚¬Â¦Ãƒâ€šÃ‚Â¡ÃƒÆ’Ã†â€™Ãƒâ€ Ã¢â‚¬â„¢ÃƒÆ’Ã‚Â¢ÃƒÂ¢Ã¢â‚¬Å¡Ã‚Â¬Ãƒâ€¦Ã‚Â¡ÃƒÆ’Ã†â€™ÃƒÂ¢Ã¢â€šÂ¬Ã…Â¡ÃƒÆ’Ã¢â‚¬Å¡Ãƒâ€šÃ‚Â°C). From Week 1 to Week 4, a clear declining trend was observed in both treatments, reaching the lowest temperatures at Week 4 (about 25.9ÃƒÆ’Ã†â€™Ãƒâ€ Ã¢â‚¬â„¢ÃƒÆ’Ã¢â‚¬Â ÃƒÂ¢Ã¢â€šÂ¬Ã¢â€žÂ¢ÃƒÆ’Ã†â€™Ãƒâ€šÃ‚Â¢ÃƒÆ’Ã‚Â¢ÃƒÂ¢Ã¢â€šÂ¬Ã…Â¡Ãƒâ€šÃ‚Â¬ÃƒÆ’Ã¢â‚¬Â¦Ãƒâ€šÃ‚Â¡ÃƒÆ’Ã†â€™Ãƒâ€ Ã¢â‚¬â„¢ÃƒÆ’Ã‚Â¢ÃƒÂ¢Ã¢â‚¬Å¡Ã‚Â¬Ãƒâ€¦Ã‚Â¡ÃƒÆ’Ã†â€™ÃƒÂ¢Ã¢â€šÂ¬Ã…Â¡ÃƒÆ’Ã¢â‚¬Å¡Ãƒâ€šÃ‚Â°C in Monoculture and 25.7ÃƒÆ’Ã†â€™Ãƒâ€ Ã¢â‚¬â„¢ÃƒÆ’Ã¢â‚¬Â ÃƒÂ¢Ã¢â€šÂ¬Ã¢â€žÂ¢ÃƒÆ’Ã†â€™Ãƒâ€šÃ‚Â¢ÃƒÆ’Ã‚Â¢ÃƒÂ¢Ã¢â€šÂ¬Ã…Â¡Ãƒâ€šÃ‚Â¬ÃƒÆ’Ã¢â‚¬Â¦Ãƒâ€šÃ‚Â¡ÃƒÆ’Ã†â€™Ãƒâ€ Ã¢â‚¬â„¢ÃƒÆ’Ã‚Â¢ÃƒÂ¢Ã¢â‚¬Å¡Ã‚Â¬Ãƒâ€¦Ã‚Â¡ÃƒÆ’Ã†â€™ÃƒÂ¢Ã¢â€šÂ¬Ã…Â¡ÃƒÆ’Ã¢â‚¬Å¡Ãƒâ€šÃ‚Â°C in IMTA). Following this decline, temperatures increased sharply in Week 5 and then remained relatively stable through Weeks 6 and 7 at approximately 28.1ÃƒÆ’Ã†â€™Ãƒâ€ Ã¢â‚¬â„¢ÃƒÆ’Ã¢â‚¬Â ÃƒÂ¢Ã¢â€šÂ¬Ã¢â€žÂ¢ÃƒÆ’Ã†â€™Ãƒâ€šÃ‚Â¢ÃƒÆ’Ã‚Â¢ÃƒÂ¢Ã¢â€šÂ¬Ã…Â¡Ãƒâ€šÃ‚Â¬ÃƒÆ’Ã¢â‚¬Â¦Ãƒâ€šÃ‚Â¡ÃƒÆ’Ã†â€™Ãƒâ€ Ã¢â‚¬â„¢ÃƒÆ’Ã‚Â¢ÃƒÂ¢Ã¢â‚¬Å¡Ã‚Â¬Ãƒâ€¦Ã‚Â¡ÃƒÆ’Ã†â€™ÃƒÂ¢Ã¢â€šÂ¬Ã…Â¡ÃƒÆ’Ã¢â‚¬Å¡Ãƒâ€šÃ‚Â°C in both systems.</w:t>
+        <w:t>The line graph illustrates the weekly variation in water temperature (ÃƒÆ’Ã†â€™Ãƒâ€ Ã¢â‚¬â„¢ÃƒÆ’Ã¢â‚¬Â ÃƒÂ¢Ã¢â€šÂ¬Ã¢â€žÂ¢ÃƒÆ’Ã†â€™ÃƒÂ¢Ã¢â€šÂ¬Ã‚Â ÃƒÆ’Ã‚Â¢ÃƒÂ¢Ã¢â‚¬Å¡Ã‚Â¬ÃƒÂ¢Ã¢â‚¬Å¾Ã‚Â¢ÃƒÆ’Ã†â€™Ãƒâ€ Ã¢â‚¬â„¢ÃƒÆ’Ã¢â‚¬Å¡Ãƒâ€šÃ‚Â¢ÃƒÆ’Ã†â€™Ãƒâ€šÃ‚Â¢ÃƒÆ’Ã‚Â¢ÃƒÂ¢Ã¢â‚¬Å¡Ã‚Â¬Ãƒâ€¦Ã‚Â¡ÃƒÆ’Ã¢â‚¬Å¡Ãƒâ€šÃ‚Â¬ÃƒÆ’Ã†â€™ÃƒÂ¢Ã¢â€šÂ¬Ã‚Â¦ÃƒÆ’Ã¢â‚¬Å¡Ãƒâ€šÃ‚Â¡ÃƒÆ’Ã†â€™Ãƒâ€ Ã¢â‚¬â„¢ÃƒÆ’Ã¢â‚¬Â ÃƒÂ¢Ã¢â€šÂ¬Ã¢â€žÂ¢ÃƒÆ’Ã†â€™Ãƒâ€šÃ‚Â¢ÃƒÆ’Ã‚Â¢ÃƒÂ¢Ã¢â€šÂ¬Ã…Â¡Ãƒâ€šÃ‚Â¬ÃƒÆ’Ã¢â‚¬Â¦Ãƒâ€šÃ‚Â¡ÃƒÆ’Ã†â€™Ãƒâ€ Ã¢â‚¬â„¢ÃƒÆ’Ã‚Â¢ÃƒÂ¢Ã¢â‚¬Å¡Ã‚Â¬Ãƒâ€¦Ã‚Â¡ÃƒÆ’Ã†â€™ÃƒÂ¢Ã¢â€šÂ¬Ã…Â¡ÃƒÆ’Ã¢â‚¬Å¡Ãƒâ€šÃ‚Â°C) in two aquaculture systems, Integrated Multi-Trophic Aquaculture (IMTA) and Monoculture, over a seven-week period. Overall, both treatments exhibited a very similar pattern of fluctuation throughout the study. At the beginning (Week 1), water temperature was relatively high in both systems, with Monoculture showing a slightly higher value (approximately 28.7ÃƒÆ’Ã†â€™Ãƒâ€ Ã¢â‚¬â„¢ÃƒÆ’Ã¢â‚¬Â ÃƒÂ¢Ã¢â€šÂ¬Ã¢â€žÂ¢ÃƒÆ’Ã†â€™ÃƒÂ¢Ã¢â€šÂ¬Ã‚Â ÃƒÆ’Ã‚Â¢ÃƒÂ¢Ã¢â‚¬Å¡Ã‚Â¬ÃƒÂ¢Ã¢â‚¬Å¾Ã‚Â¢ÃƒÆ’Ã†â€™Ãƒâ€ Ã¢â‚¬â„¢ÃƒÆ’Ã¢â‚¬Å¡Ãƒâ€šÃ‚Â¢ÃƒÆ’Ã†â€™Ãƒâ€šÃ‚Â¢ÃƒÆ’Ã‚Â¢ÃƒÂ¢Ã¢â‚¬Å¡Ã‚Â¬Ãƒâ€¦Ã‚Â¡ÃƒÆ’Ã¢â‚¬Å¡Ãƒâ€šÃ‚Â¬ÃƒÆ’Ã†â€™ÃƒÂ¢Ã¢â€šÂ¬Ã‚Â¦ÃƒÆ’Ã¢â‚¬Å¡Ãƒâ€šÃ‚Â¡ÃƒÆ’Ã†â€™Ãƒâ€ Ã¢â‚¬â„¢ÃƒÆ’Ã¢â‚¬Â ÃƒÂ¢Ã¢â€šÂ¬Ã¢â€žÂ¢ÃƒÆ’Ã†â€™Ãƒâ€šÃ‚Â¢ÃƒÆ’Ã‚Â¢ÃƒÂ¢Ã¢â€šÂ¬Ã…Â¡Ãƒâ€šÃ‚Â¬ÃƒÆ’Ã¢â‚¬Â¦Ãƒâ€šÃ‚Â¡ÃƒÆ’Ã†â€™Ãƒâ€ Ã¢â‚¬â„¢ÃƒÆ’Ã‚Â¢ÃƒÂ¢Ã¢â‚¬Å¡Ã‚Â¬Ãƒâ€¦Ã‚Â¡ÃƒÆ’Ã†â€™ÃƒÂ¢Ã¢â€šÂ¬Ã…Â¡ÃƒÆ’Ã¢â‚¬Å¡Ãƒâ€šÃ‚Â°C) compared to IMTA (around 28.2ÃƒÆ’Ã†â€™Ãƒâ€ Ã¢â‚¬â„¢ÃƒÆ’Ã¢â‚¬Â ÃƒÂ¢Ã¢â€šÂ¬Ã¢â€žÂ¢ÃƒÆ’Ã†â€™ÃƒÂ¢Ã¢â€šÂ¬Ã‚Â ÃƒÆ’Ã‚Â¢ÃƒÂ¢Ã¢â‚¬Å¡Ã‚Â¬ÃƒÂ¢Ã¢â‚¬Å¾Ã‚Â¢ÃƒÆ’Ã†â€™Ãƒâ€ Ã¢â‚¬â„¢ÃƒÆ’Ã¢â‚¬Å¡Ãƒâ€šÃ‚Â¢ÃƒÆ’Ã†â€™Ãƒâ€šÃ‚Â¢ÃƒÆ’Ã‚Â¢ÃƒÂ¢Ã¢â‚¬Å¡Ã‚Â¬Ãƒâ€¦Ã‚Â¡ÃƒÆ’Ã¢â‚¬Å¡Ãƒâ€šÃ‚Â¬ÃƒÆ’Ã†â€™ÃƒÂ¢Ã¢â€šÂ¬Ã‚Â¦ÃƒÆ’Ã¢â‚¬Å¡Ãƒâ€šÃ‚Â¡ÃƒÆ’Ã†â€™Ãƒâ€ Ã¢â‚¬â„¢ÃƒÆ’Ã¢â‚¬Â ÃƒÂ¢Ã¢â€šÂ¬Ã¢â€žÂ¢ÃƒÆ’Ã†â€™Ãƒâ€šÃ‚Â¢ÃƒÆ’Ã‚Â¢ÃƒÂ¢Ã¢â€šÂ¬Ã…Â¡Ãƒâ€šÃ‚Â¬ÃƒÆ’Ã¢â‚¬Â¦Ãƒâ€šÃ‚Â¡ÃƒÆ’Ã†â€™Ãƒâ€ Ã¢â‚¬â„¢ÃƒÆ’Ã‚Â¢ÃƒÂ¢Ã¢â‚¬Å¡Ã‚Â¬Ãƒâ€¦Ã‚Â¡ÃƒÆ’Ã†â€™ÃƒÂ¢Ã¢â€šÂ¬Ã…Â¡ÃƒÆ’Ã¢â‚¬Å¡Ãƒâ€šÃ‚Â°C). From Week 1 to Week 4, a clear declining trend was observed in both treatments, reaching the lowest temperatures at Week 4 (about 25.9ÃƒÆ’Ã†â€™Ãƒâ€ Ã¢â‚¬â„¢ÃƒÆ’Ã¢â‚¬Â ÃƒÂ¢Ã¢â€šÂ¬Ã¢â€žÂ¢ÃƒÆ’Ã†â€™ÃƒÂ¢Ã¢â€šÂ¬Ã‚Â ÃƒÆ’Ã‚Â¢ÃƒÂ¢Ã¢â‚¬Å¡Ã‚Â¬ÃƒÂ¢Ã¢â‚¬Å¾Ã‚Â¢ÃƒÆ’Ã†â€™Ãƒâ€ Ã¢â‚¬â„¢ÃƒÆ’Ã¢â‚¬Å¡Ãƒâ€šÃ‚Â¢ÃƒÆ’Ã†â€™Ãƒâ€šÃ‚Â¢ÃƒÆ’Ã‚Â¢ÃƒÂ¢Ã¢â‚¬Å¡Ã‚Â¬Ãƒâ€¦Ã‚Â¡ÃƒÆ’Ã¢â‚¬Å¡Ãƒâ€šÃ‚Â¬ÃƒÆ’Ã†â€™ÃƒÂ¢Ã¢â€šÂ¬Ã‚Â¦ÃƒÆ’Ã¢â‚¬Å¡Ãƒâ€šÃ‚Â¡ÃƒÆ’Ã†â€™Ãƒâ€ Ã¢â‚¬â„¢ÃƒÆ’Ã¢â‚¬Â ÃƒÂ¢Ã¢â€šÂ¬Ã¢â€žÂ¢ÃƒÆ’Ã†â€™Ãƒâ€šÃ‚Â¢ÃƒÆ’Ã‚Â¢ÃƒÂ¢Ã¢â€šÂ¬Ã…Â¡Ãƒâ€šÃ‚Â¬ÃƒÆ’Ã¢â‚¬Â¦Ãƒâ€šÃ‚Â¡ÃƒÆ’Ã†â€™Ãƒâ€ Ã¢â‚¬â„¢ÃƒÆ’Ã‚Â¢ÃƒÂ¢Ã¢â‚¬Å¡Ã‚Â¬Ãƒâ€¦Ã‚Â¡ÃƒÆ’Ã†â€™ÃƒÂ¢Ã¢â€šÂ¬Ã…Â¡ÃƒÆ’Ã¢â‚¬Å¡Ãƒâ€šÃ‚Â°C in Monoculture and 25.7ÃƒÆ’Ã†â€™Ãƒâ€ Ã¢â‚¬â„¢ÃƒÆ’Ã¢â‚¬Â ÃƒÂ¢Ã¢â€šÂ¬Ã¢â€žÂ¢ÃƒÆ’Ã†â€™ÃƒÂ¢Ã¢â€šÂ¬Ã‚Â ÃƒÆ’Ã‚Â¢ÃƒÂ¢Ã¢â‚¬Å¡Ã‚Â¬ÃƒÂ¢Ã¢â‚¬Å¾Ã‚Â¢ÃƒÆ’Ã†â€™Ãƒâ€ Ã¢â‚¬â„¢ÃƒÆ’Ã¢â‚¬Å¡Ãƒâ€šÃ‚Â¢ÃƒÆ’Ã†â€™Ãƒâ€šÃ‚Â¢ÃƒÆ’Ã‚Â¢ÃƒÂ¢Ã¢â‚¬Å¡Ã‚Â¬Ãƒâ€¦Ã‚Â¡ÃƒÆ’Ã¢â‚¬Å¡Ãƒâ€šÃ‚Â¬ÃƒÆ’Ã†â€™ÃƒÂ¢Ã¢â€šÂ¬Ã‚Â¦ÃƒÆ’Ã¢â‚¬Å¡Ãƒâ€šÃ‚Â¡ÃƒÆ’Ã†â€™Ãƒâ€ Ã¢â‚¬â„¢ÃƒÆ’Ã¢â‚¬Â ÃƒÂ¢Ã¢â€šÂ¬Ã¢â€žÂ¢ÃƒÆ’Ã†â€™Ãƒâ€šÃ‚Â¢ÃƒÆ’Ã‚Â¢ÃƒÂ¢Ã¢â€šÂ¬Ã…Â¡Ãƒâ€šÃ‚Â¬ÃƒÆ’Ã¢â‚¬Â¦Ãƒâ€šÃ‚Â¡ÃƒÆ’Ã†â€™Ãƒâ€ Ã¢â‚¬â„¢ÃƒÆ’Ã‚Â¢ÃƒÂ¢Ã¢â‚¬Å¡Ã‚Â¬Ãƒâ€¦Ã‚Â¡ÃƒÆ’Ã†â€™ÃƒÂ¢Ã¢â€šÂ¬Ã…Â¡ÃƒÆ’Ã¢â‚¬Å¡Ãƒâ€šÃ‚Â°C in IMTA). Following this decline, temperatures increased sharply in Week 5 and then remained relatively stable through Weeks 6 and 7 at approximately 28.1ÃƒÆ’Ã†â€™Ãƒâ€ Ã¢â‚¬â„¢ÃƒÆ’Ã¢â‚¬Â ÃƒÂ¢Ã¢â€šÂ¬Ã¢â€žÂ¢ÃƒÆ’Ã†â€™ÃƒÂ¢Ã¢â€šÂ¬Ã‚Â ÃƒÆ’Ã‚Â¢ÃƒÂ¢Ã¢â‚¬Å¡Ã‚Â¬ÃƒÂ¢Ã¢â‚¬Å¾Ã‚Â¢ÃƒÆ’Ã†â€™Ãƒâ€ Ã¢â‚¬â„¢ÃƒÆ’Ã¢â‚¬Å¡Ãƒâ€šÃ‚Â¢ÃƒÆ’Ã†â€™Ãƒâ€šÃ‚Â¢ÃƒÆ’Ã‚Â¢ÃƒÂ¢Ã¢â‚¬Å¡Ã‚Â¬Ãƒâ€¦Ã‚Â¡ÃƒÆ’Ã¢â‚¬Å¡Ãƒâ€šÃ‚Â¬ÃƒÆ’Ã†â€™ÃƒÂ¢Ã¢â€šÂ¬Ã‚Â¦ÃƒÆ’Ã¢â‚¬Å¡Ãƒâ€šÃ‚Â¡ÃƒÆ’Ã†â€™Ãƒâ€ Ã¢â‚¬â„¢ÃƒÆ’Ã¢â‚¬Â ÃƒÂ¢Ã¢â€šÂ¬Ã¢â€žÂ¢ÃƒÆ’Ã†â€™Ãƒâ€šÃ‚Â¢ÃƒÆ’Ã‚Â¢ÃƒÂ¢Ã¢â€šÂ¬Ã…Â¡Ãƒâ€šÃ‚Â¬ÃƒÆ’Ã¢â‚¬Â¦Ãƒâ€šÃ‚Â¡ÃƒÆ’Ã†â€™Ãƒâ€ Ã¢â‚¬â„¢ÃƒÆ’Ã‚Â¢ÃƒÂ¢Ã¢â‚¬Å¡Ã‚Â¬Ãƒâ€¦Ã‚Â¡ÃƒÆ’Ã†â€™ÃƒÂ¢Ã¢â€šÂ¬Ã…Â¡ÃƒÆ’Ã¢â‚¬Å¡Ãƒâ€šÃ‚Â°C in both systems.</w:t>
       </w:r>
     </w:p>
     <w:p>
@@ -7018,7 +7018,7 @@
               <w:rPr>
                 <w:rFonts w:ascii="Times New Roman" w:hAnsi="Times New Roman" w:cs="Times New Roman"/>
               </w:rPr>
-              <w:t>pH (Mean ÃƒÆ’Ã†â€™Ãƒâ€ Ã¢â‚¬â„¢ÃƒÆ’Ã¢â‚¬Â ÃƒÂ¢Ã¢â€šÂ¬Ã¢â€žÂ¢ÃƒÆ’Ã†â€™Ãƒâ€šÃ‚Â¢ÃƒÆ’Ã‚Â¢ÃƒÂ¢Ã¢â€šÂ¬Ã…Â¡Ãƒâ€šÃ‚Â¬ÃƒÆ’Ã¢â‚¬Â¦Ãƒâ€šÃ‚Â¡ÃƒÆ’Ã†â€™Ãƒâ€ Ã¢â‚¬â„¢ÃƒÆ’Ã‚Â¢ÃƒÂ¢Ã¢â‚¬Å¡Ã‚Â¬Ãƒâ€¦Ã‚Â¡ÃƒÆ’Ã†â€™ÃƒÂ¢Ã¢â€šÂ¬Ã…Â¡ÃƒÆ’Ã¢â‚¬Å¡Ãƒâ€šÃ‚Â± SD)</w:t>
+              <w:t>pH (Mean ÃƒÆ’Ã†â€™Ãƒâ€ Ã¢â‚¬â„¢ÃƒÆ’Ã¢â‚¬Â ÃƒÂ¢Ã¢â€šÂ¬Ã¢â€žÂ¢ÃƒÆ’Ã†â€™ÃƒÂ¢Ã¢â€šÂ¬Ã‚Â ÃƒÆ’Ã‚Â¢ÃƒÂ¢Ã¢â‚¬Å¡Ã‚Â¬ÃƒÂ¢Ã¢â‚¬Å¾Ã‚Â¢ÃƒÆ’Ã†â€™Ãƒâ€ Ã¢â‚¬â„¢ÃƒÆ’Ã¢â‚¬Å¡Ãƒâ€šÃ‚Â¢ÃƒÆ’Ã†â€™Ãƒâ€šÃ‚Â¢ÃƒÆ’Ã‚Â¢ÃƒÂ¢Ã¢â‚¬Å¡Ã‚Â¬Ãƒâ€¦Ã‚Â¡ÃƒÆ’Ã¢â‚¬Å¡Ãƒâ€šÃ‚Â¬ÃƒÆ’Ã†â€™ÃƒÂ¢Ã¢â€šÂ¬Ã‚Â¦ÃƒÆ’Ã¢â‚¬Å¡Ãƒâ€šÃ‚Â¡ÃƒÆ’Ã†â€™Ãƒâ€ Ã¢â‚¬â„¢ÃƒÆ’Ã¢â‚¬Â ÃƒÂ¢Ã¢â€šÂ¬Ã¢â€žÂ¢ÃƒÆ’Ã†â€™Ãƒâ€šÃ‚Â¢ÃƒÆ’Ã‚Â¢ÃƒÂ¢Ã¢â€šÂ¬Ã…Â¡Ãƒâ€šÃ‚Â¬ÃƒÆ’Ã¢â‚¬Â¦Ãƒâ€šÃ‚Â¡ÃƒÆ’Ã†â€™Ãƒâ€ Ã¢â‚¬â„¢ÃƒÆ’Ã‚Â¢ÃƒÂ¢Ã¢â‚¬Å¡Ã‚Â¬Ãƒâ€¦Ã‚Â¡ÃƒÆ’Ã†â€™ÃƒÂ¢Ã¢â€šÂ¬Ã…Â¡ÃƒÆ’Ã¢â‚¬Å¡Ãƒâ€šÃ‚Â± SD)</w:t>
             </w:r>
           </w:p>
         </w:tc>
@@ -7075,7 +7075,7 @@
               <w:rPr>
                 <w:rFonts w:ascii="Times New Roman" w:hAnsi="Times New Roman" w:cs="Times New Roman"/>
               </w:rPr>
-              <w:t>Temperature (ÃƒÆ’Ã†â€™Ãƒâ€ Ã¢â‚¬â„¢ÃƒÆ’Ã¢â‚¬Â ÃƒÂ¢Ã¢â€šÂ¬Ã¢â€žÂ¢ÃƒÆ’Ã†â€™Ãƒâ€šÃ‚Â¢ÃƒÆ’Ã‚Â¢ÃƒÂ¢Ã¢â€šÂ¬Ã…Â¡Ãƒâ€šÃ‚Â¬ÃƒÆ’Ã¢â‚¬Â¦Ãƒâ€šÃ‚Â¡ÃƒÆ’Ã†â€™Ãƒâ€ Ã¢â‚¬â„¢ÃƒÆ’Ã‚Â¢ÃƒÂ¢Ã¢â‚¬Å¡Ã‚Â¬Ãƒâ€¦Ã‚Â¡ÃƒÆ’Ã†â€™ÃƒÂ¢Ã¢â€šÂ¬Ã…Â¡ÃƒÆ’Ã¢â‚¬Å¡Ãƒâ€šÃ‚Â°C)</w:t>
+              <w:t>Temperature (ÃƒÆ’Ã†â€™Ãƒâ€ Ã¢â‚¬â„¢ÃƒÆ’Ã¢â‚¬Â ÃƒÂ¢Ã¢â€šÂ¬Ã¢â€žÂ¢ÃƒÆ’Ã†â€™ÃƒÂ¢Ã¢â€šÂ¬Ã‚Â ÃƒÆ’Ã‚Â¢ÃƒÂ¢Ã¢â‚¬Å¡Ã‚Â¬ÃƒÂ¢Ã¢â‚¬Å¾Ã‚Â¢ÃƒÆ’Ã†â€™Ãƒâ€ Ã¢â‚¬â„¢ÃƒÆ’Ã¢â‚¬Å¡Ãƒâ€šÃ‚Â¢ÃƒÆ’Ã†â€™Ãƒâ€šÃ‚Â¢ÃƒÆ’Ã‚Â¢ÃƒÂ¢Ã¢â‚¬Å¡Ã‚Â¬Ãƒâ€¦Ã‚Â¡ÃƒÆ’Ã¢â‚¬Å¡Ãƒâ€šÃ‚Â¬ÃƒÆ’Ã†â€™ÃƒÂ¢Ã¢â€šÂ¬Ã‚Â¦ÃƒÆ’Ã¢â‚¬Å¡Ãƒâ€šÃ‚Â¡ÃƒÆ’Ã†â€™Ãƒâ€ Ã¢â‚¬â„¢ÃƒÆ’Ã¢â‚¬Â ÃƒÂ¢Ã¢â€šÂ¬Ã¢â€žÂ¢ÃƒÆ’Ã†â€™Ãƒâ€šÃ‚Â¢ÃƒÆ’Ã‚Â¢ÃƒÂ¢Ã¢â€šÂ¬Ã…Â¡Ãƒâ€šÃ‚Â¬ÃƒÆ’Ã¢â‚¬Â¦Ãƒâ€šÃ‚Â¡ÃƒÆ’Ã†â€™Ãƒâ€ Ã¢â‚¬â„¢ÃƒÆ’Ã‚Â¢ÃƒÂ¢Ã¢â‚¬Å¡Ã‚Â¬Ãƒâ€¦Ã‚Â¡ÃƒÆ’Ã†â€™ÃƒÂ¢Ã¢â€šÂ¬Ã…Â¡ÃƒÆ’Ã¢â‚¬Å¡Ãƒâ€šÃ‚Â°C)</w:t>
             </w:r>
           </w:p>
         </w:tc>
@@ -8016,7 +8016,7 @@
         <w:rPr>
           <w:rFonts w:ascii="Times New Roman" w:hAnsi="Times New Roman" w:cs="Times New Roman"/>
         </w:rPr>
-        <w:t>-chemical water quality parameters for IMTA (Integrated Multi-Trophic Aquaculture) and Monoculture treatments over a seven-week experimental period. Overall, both systems exhibited similar temporal patterns in temperature and pH, indicating that basic physical parameters followed the same environmental fluctuations in both treatments. Water temperature in both systems showed a declining trend from approximately 28ÃƒÆ’Ã†â€™Ãƒâ€ Ã¢â‚¬â„¢ÃƒÆ’Ã¢â‚¬Â ÃƒÂ¢Ã¢â€šÂ¬Ã¢â€žÂ¢ÃƒÆ’Ã†â€™Ãƒâ€šÃ‚Â¢ÃƒÆ’Ã‚Â¢ÃƒÂ¢Ã¢â€šÂ¬Ã…Â¡Ãƒâ€šÃ‚Â¬ÃƒÆ’Ã¢â‚¬Â¦Ãƒâ€šÃ‚Â¡ÃƒÆ’Ã†â€™Ãƒâ€ Ã¢â‚¬â„¢ÃƒÆ’Ã‚Â¢ÃƒÂ¢Ã¢â‚¬Å¡Ã‚Â¬Ãƒâ€¦Ã‚Â¡ÃƒÆ’Ã†â€™ÃƒÂ¢Ã¢â€šÂ¬Ã…Â¡ÃƒÆ’Ã¢â‚¬Å¡Ãƒâ€šÃ‚Â°C at the beginning to a minimum of around 25.6ÃƒÆ’Ã†â€™Ãƒâ€ Ã¢â‚¬â„¢ÃƒÆ’Ã¢â‚¬Â ÃƒÂ¢Ã¢â€šÂ¬Ã¢â€žÂ¢ÃƒÆ’Ã†â€™ÃƒÂ¢Ã¢â€šÂ¬Ã…Â¡ÃƒÆ’Ã¢â‚¬Å¡Ãƒâ€šÃ‚Â¢ÃƒÆ’Ã†â€™Ãƒâ€ Ã¢â‚¬â„¢ÃƒÆ’Ã¢â‚¬Å¡Ãƒâ€šÃ‚Â¢ÃƒÆ’Ã†â€™Ãƒâ€šÃ‚Â¢ÃƒÆ’Ã‚Â¢ÃƒÂ¢Ã¢â€šÂ¬Ã…Â¡Ãƒâ€šÃ‚Â¬ÃƒÆ’Ã¢â‚¬Â¦Ãƒâ€šÃ‚Â¡ÃƒÆ’Ã†â€™ÃƒÂ¢Ã¢â€šÂ¬Ã…Â¡ÃƒÆ’Ã¢â‚¬Å¡Ãƒâ€šÃ‚Â¬ÃƒÆ’Ã†â€™Ãƒâ€ Ã¢â‚¬â„¢ÃƒÆ’Ã¢â‚¬Å¡Ãƒâ€šÃ‚Â¢ÃƒÆ’Ã†â€™Ãƒâ€šÃ‚Â¢ÃƒÆ’Ã‚Â¢ÃƒÂ¢Ã¢â‚¬Å¡Ã‚Â¬Ãƒâ€¦Ã‚Â¡ÃƒÆ’Ã¢â‚¬Å¡Ãƒâ€šÃ‚Â¬ÃƒÆ’Ã†â€™ÃƒÂ¢Ã¢â€šÂ¬Ã‚Â¦ÃƒÆ’Ã‚Â¢ÃƒÂ¢Ã¢â‚¬Å¡Ã‚Â¬Ãƒâ€¦Ã¢â‚¬Å“25.9ÃƒÆ’Ã†â€™Ãƒâ€ Ã¢â‚¬â„¢ÃƒÆ’Ã¢â‚¬Â ÃƒÂ¢Ã¢â€šÂ¬Ã¢â€žÂ¢ÃƒÆ’Ã†â€™Ãƒâ€šÃ‚Â¢ÃƒÆ’Ã‚Â¢ÃƒÂ¢Ã¢â€šÂ¬Ã…Â¡Ãƒâ€šÃ‚Â¬ÃƒÆ’Ã¢â‚¬Â¦Ãƒâ€šÃ‚Â¡ÃƒÆ’Ã†â€™Ãƒâ€ Ã¢â‚¬â„¢ÃƒÆ’Ã‚Â¢ÃƒÂ¢Ã¢â‚¬Å¡Ã‚Â¬Ãƒâ€¦Ã‚Â¡ÃƒÆ’Ã†â€™ÃƒÂ¢Ã¢â€šÂ¬Ã…Â¡ÃƒÆ’Ã¢â‚¬Å¡Ãƒâ€šÃ‚Â°C in Week 4, before recovering and stabilizing at about 28.1ÃƒÆ’Ã†â€™Ãƒâ€ Ã¢â‚¬â„¢ÃƒÆ’Ã¢â‚¬Â ÃƒÂ¢Ã¢â€šÂ¬Ã¢â€žÂ¢ÃƒÆ’Ã†â€™Ãƒâ€šÃ‚Â¢ÃƒÆ’Ã‚Â¢ÃƒÂ¢Ã¢â€šÂ¬Ã…Â¡Ãƒâ€šÃ‚Â¬ÃƒÆ’Ã¢â‚¬Â¦Ãƒâ€šÃ‚Â¡ÃƒÆ’Ã†â€™Ãƒâ€ Ã¢â‚¬â„¢ÃƒÆ’Ã‚Â¢ÃƒÂ¢Ã¢â‚¬Å¡Ã‚Â¬Ãƒâ€¦Ã‚Â¡ÃƒÆ’Ã†â€™ÃƒÂ¢Ã¢â€šÂ¬Ã…Â¡ÃƒÆ’Ã¢â‚¬Å¡Ãƒâ€šÃ‚Â°C by Week 7. Similarly, pH remained consistently alkaline throughout the study, with both treatments peaking in Week 4 (IMTA: 8.35; Monoculture: 8.37) and then gradually declining and stabilizing. From Week 3 onward, the IMTA system generally maintained slightly lower pH values compared to the Monoculture system.</w:t>
+        <w:t>-chemical water quality parameters for IMTA (Integrated Multi-Trophic Aquaculture) and Monoculture treatments over a seven-week experimental period. Overall, both systems exhibited similar temporal patterns in temperature and pH, indicating that basic physical parameters followed the same environmental fluctuations in both treatments. Water temperature in both systems showed a declining trend from approximately 28ÃƒÆ’Ã†â€™Ãƒâ€ Ã¢â‚¬â„¢ÃƒÆ’Ã¢â‚¬Â ÃƒÂ¢Ã¢â€šÂ¬Ã¢â€žÂ¢ÃƒÆ’Ã†â€™ÃƒÂ¢Ã¢â€šÂ¬Ã‚Â ÃƒÆ’Ã‚Â¢ÃƒÂ¢Ã¢â‚¬Å¡Ã‚Â¬ÃƒÂ¢Ã¢â‚¬Å¾Ã‚Â¢ÃƒÆ’Ã†â€™Ãƒâ€ Ã¢â‚¬â„¢ÃƒÆ’Ã¢â‚¬Å¡Ãƒâ€šÃ‚Â¢ÃƒÆ’Ã†â€™Ãƒâ€šÃ‚Â¢ÃƒÆ’Ã‚Â¢ÃƒÂ¢Ã¢â‚¬Å¡Ã‚Â¬Ãƒâ€¦Ã‚Â¡ÃƒÆ’Ã¢â‚¬Å¡Ãƒâ€šÃ‚Â¬ÃƒÆ’Ã†â€™ÃƒÂ¢Ã¢â€šÂ¬Ã‚Â¦ÃƒÆ’Ã¢â‚¬Å¡Ãƒâ€šÃ‚Â¡ÃƒÆ’Ã†â€™Ãƒâ€ Ã¢â‚¬â„¢ÃƒÆ’Ã¢â‚¬Â ÃƒÂ¢Ã¢â€šÂ¬Ã¢â€žÂ¢ÃƒÆ’Ã†â€™Ãƒâ€šÃ‚Â¢ÃƒÆ’Ã‚Â¢ÃƒÂ¢Ã¢â€šÂ¬Ã…Â¡Ãƒâ€šÃ‚Â¬ÃƒÆ’Ã¢â‚¬Â¦Ãƒâ€šÃ‚Â¡ÃƒÆ’Ã†â€™Ãƒâ€ Ã¢â‚¬â„¢ÃƒÆ’Ã‚Â¢ÃƒÂ¢Ã¢â‚¬Å¡Ã‚Â¬Ãƒâ€¦Ã‚Â¡ÃƒÆ’Ã†â€™ÃƒÂ¢Ã¢â€šÂ¬Ã…Â¡ÃƒÆ’Ã¢â‚¬Å¡Ãƒâ€šÃ‚Â°C at the beginning to a minimum of around 25.6ÃƒÆ’Ã†â€™Ãƒâ€ Ã¢â‚¬â„¢ÃƒÆ’Ã¢â‚¬Â ÃƒÂ¢Ã¢â€šÂ¬Ã¢â€žÂ¢ÃƒÆ’Ã†â€™ÃƒÂ¢Ã¢â€šÂ¬Ã‚Â ÃƒÆ’Ã‚Â¢ÃƒÂ¢Ã¢â‚¬Å¡Ã‚Â¬ÃƒÂ¢Ã¢â‚¬Å¾Ã‚Â¢ÃƒÆ’Ã†â€™Ãƒâ€ Ã¢â‚¬â„¢ÃƒÆ’Ã‚Â¢ÃƒÂ¢Ã¢â‚¬Å¡Ã‚Â¬Ãƒâ€¦Ã‚Â¡ÃƒÆ’Ã†â€™ÃƒÂ¢Ã¢â€šÂ¬Ã…Â¡ÃƒÆ’Ã¢â‚¬Å¡Ãƒâ€šÃ‚Â¢ÃƒÆ’Ã†â€™Ãƒâ€ Ã¢â‚¬â„¢ÃƒÆ’Ã¢â‚¬Â ÃƒÂ¢Ã¢â€šÂ¬Ã¢â€žÂ¢ÃƒÆ’Ã†â€™ÃƒÂ¢Ã¢â€šÂ¬Ã…Â¡ÃƒÆ’Ã¢â‚¬Å¡Ãƒâ€šÃ‚Â¢ÃƒÆ’Ã†â€™Ãƒâ€ Ã¢â‚¬â„¢ÃƒÆ’Ã¢â‚¬Å¡Ãƒâ€šÃ‚Â¢ÃƒÆ’Ã†â€™Ãƒâ€šÃ‚Â¢ÃƒÆ’Ã‚Â¢ÃƒÂ¢Ã¢â‚¬Å¡Ã‚Â¬Ãƒâ€¦Ã‚Â¡ÃƒÆ’Ã¢â‚¬Å¡Ãƒâ€šÃ‚Â¬ÃƒÆ’Ã†â€™ÃƒÂ¢Ã¢â€šÂ¬Ã‚Â¦ÃƒÆ’Ã¢â‚¬Å¡Ãƒâ€šÃ‚Â¡ÃƒÆ’Ã†â€™Ãƒâ€ Ã¢â‚¬â„¢ÃƒÆ’Ã‚Â¢ÃƒÂ¢Ã¢â‚¬Å¡Ã‚Â¬Ãƒâ€¦Ã‚Â¡ÃƒÆ’Ã†â€™ÃƒÂ¢Ã¢â€šÂ¬Ã…Â¡ÃƒÆ’Ã¢â‚¬Å¡Ãƒâ€šÃ‚Â¬ÃƒÆ’Ã†â€™Ãƒâ€ Ã¢â‚¬â„¢ÃƒÆ’Ã¢â‚¬Â ÃƒÂ¢Ã¢â€šÂ¬Ã¢â€žÂ¢ÃƒÆ’Ã†â€™ÃƒÂ¢Ã¢â€šÂ¬Ã…Â¡ÃƒÆ’Ã¢â‚¬Å¡Ãƒâ€šÃ‚Â¢ÃƒÆ’Ã†â€™Ãƒâ€ Ã¢â‚¬â„¢ÃƒÆ’Ã¢â‚¬Å¡Ãƒâ€šÃ‚Â¢ÃƒÆ’Ã†â€™Ãƒâ€šÃ‚Â¢ÃƒÆ’Ã‚Â¢ÃƒÂ¢Ã¢â€šÂ¬Ã…Â¡Ãƒâ€šÃ‚Â¬ÃƒÆ’Ã¢â‚¬Â¦Ãƒâ€šÃ‚Â¡ÃƒÆ’Ã†â€™ÃƒÂ¢Ã¢â€šÂ¬Ã…Â¡ÃƒÆ’Ã¢â‚¬Å¡Ãƒâ€šÃ‚Â¬ÃƒÆ’Ã†â€™Ãƒâ€ Ã¢â‚¬â„¢ÃƒÆ’Ã‚Â¢ÃƒÂ¢Ã¢â‚¬Å¡Ã‚Â¬Ãƒâ€šÃ‚Â¦ÃƒÆ’Ã†â€™Ãƒâ€šÃ‚Â¢ÃƒÆ’Ã‚Â¢ÃƒÂ¢Ã¢â€šÂ¬Ã…Â¡Ãƒâ€šÃ‚Â¬ÃƒÆ’Ã¢â‚¬Â¦ÃƒÂ¢Ã¢â€šÂ¬Ã…â€œ25.9ÃƒÆ’Ã†â€™Ãƒâ€ Ã¢â‚¬â„¢ÃƒÆ’Ã¢â‚¬Â ÃƒÂ¢Ã¢â€šÂ¬Ã¢â€žÂ¢ÃƒÆ’Ã†â€™ÃƒÂ¢Ã¢â€šÂ¬Ã‚Â ÃƒÆ’Ã‚Â¢ÃƒÂ¢Ã¢â‚¬Å¡Ã‚Â¬ÃƒÂ¢Ã¢â‚¬Å¾Ã‚Â¢ÃƒÆ’Ã†â€™Ãƒâ€ Ã¢â‚¬â„¢ÃƒÆ’Ã¢â‚¬Å¡Ãƒâ€šÃ‚Â¢ÃƒÆ’Ã†â€™Ãƒâ€šÃ‚Â¢ÃƒÆ’Ã‚Â¢ÃƒÂ¢Ã¢â‚¬Å¡Ã‚Â¬Ãƒâ€¦Ã‚Â¡ÃƒÆ’Ã¢â‚¬Å¡Ãƒâ€šÃ‚Â¬ÃƒÆ’Ã†â€™ÃƒÂ¢Ã¢â€šÂ¬Ã‚Â¦ÃƒÆ’Ã¢â‚¬Å¡Ãƒâ€šÃ‚Â¡ÃƒÆ’Ã†â€™Ãƒâ€ Ã¢â‚¬â„¢ÃƒÆ’Ã¢â‚¬Â ÃƒÂ¢Ã¢â€šÂ¬Ã¢â€žÂ¢ÃƒÆ’Ã†â€™Ãƒâ€šÃ‚Â¢ÃƒÆ’Ã‚Â¢ÃƒÂ¢Ã¢â€šÂ¬Ã…Â¡Ãƒâ€šÃ‚Â¬ÃƒÆ’Ã¢â‚¬Â¦Ãƒâ€šÃ‚Â¡ÃƒÆ’Ã†â€™Ãƒâ€ Ã¢â‚¬â„¢ÃƒÆ’Ã‚Â¢ÃƒÂ¢Ã¢â‚¬Å¡Ã‚Â¬Ãƒâ€¦Ã‚Â¡ÃƒÆ’Ã†â€™ÃƒÂ¢Ã¢â€šÂ¬Ã…Â¡ÃƒÆ’Ã¢â‚¬Å¡Ãƒâ€šÃ‚Â°C in Week 4, before recovering and stabilizing at about 28.1ÃƒÆ’Ã†â€™Ãƒâ€ Ã¢â‚¬â„¢ÃƒÆ’Ã¢â‚¬Â ÃƒÂ¢Ã¢â€šÂ¬Ã¢â€žÂ¢ÃƒÆ’Ã†â€™ÃƒÂ¢Ã¢â€šÂ¬Ã‚Â ÃƒÆ’Ã‚Â¢ÃƒÂ¢Ã¢â‚¬Å¡Ã‚Â¬ÃƒÂ¢Ã¢â‚¬Å¾Ã‚Â¢ÃƒÆ’Ã†â€™Ãƒâ€ Ã¢â‚¬â„¢ÃƒÆ’Ã¢â‚¬Å¡Ãƒâ€šÃ‚Â¢ÃƒÆ’Ã†â€™Ãƒâ€šÃ‚Â¢ÃƒÆ’Ã‚Â¢ÃƒÂ¢Ã¢â‚¬Å¡Ã‚Â¬Ãƒâ€¦Ã‚Â¡ÃƒÆ’Ã¢â‚¬Å¡Ãƒâ€šÃ‚Â¬ÃƒÆ’Ã†â€™ÃƒÂ¢Ã¢â€šÂ¬Ã‚Â¦ÃƒÆ’Ã¢â‚¬Å¡Ãƒâ€šÃ‚Â¡ÃƒÆ’Ã†â€™Ãƒâ€ Ã¢â‚¬â„¢ÃƒÆ’Ã¢â‚¬Â ÃƒÂ¢Ã¢â€šÂ¬Ã¢â€žÂ¢ÃƒÆ’Ã†â€™Ãƒâ€šÃ‚Â¢ÃƒÆ’Ã‚Â¢ÃƒÂ¢Ã¢â€šÂ¬Ã…Â¡Ãƒâ€šÃ‚Â¬ÃƒÆ’Ã¢â‚¬Â¦Ãƒâ€šÃ‚Â¡ÃƒÆ’Ã†â€™Ãƒâ€ Ã¢â‚¬â„¢ÃƒÆ’Ã‚Â¢ÃƒÂ¢Ã¢â‚¬Å¡Ã‚Â¬Ãƒâ€¦Ã‚Â¡ÃƒÆ’Ã†â€™ÃƒÂ¢Ã¢â€šÂ¬Ã…Â¡ÃƒÆ’Ã¢â‚¬Å¡Ãƒâ€šÃ‚Â°C by Week 7. Similarly, pH remained consistently alkaline throughout the study, with both treatments peaking in Week 4 (IMTA: 8.35; Monoculture: 8.37) and then gradually declining and stabilizing. From Week 3 onward, the IMTA system generally maintained slightly lower pH values compared to the Monoculture system.</w:t>
       </w:r>
     </w:p>
     <w:p>
@@ -8258,7 +8258,7 @@
           <w:sz w:val="28"/>
           <w:szCs w:val="28"/>
         </w:rPr>
-        <w:t>ÃƒÆ’Ã†â€™Ãƒâ€ Ã¢â‚¬â„¢ÃƒÆ’Ã¢â‚¬Â ÃƒÂ¢Ã¢â€šÂ¬Ã¢â€žÂ¢ÃƒÆ’Ã†â€™ÃƒÂ¢Ã¢â€šÂ¬Ã‚Â¦ÃƒÆ’Ã¢â‚¬Å¡Ãƒâ€šÃ‚Â½ÃƒÆ’Ã†â€™Ãƒâ€ Ã¢â‚¬â„¢ÃƒÆ’Ã‚Â¢ÃƒÂ¢Ã¢â‚¬Å¡Ã‚Â¬Ãƒâ€¦Ã‚Â¡ÃƒÆ’Ã†â€™ÃƒÂ¢Ã¢â€šÂ¬Ã…Â¡ÃƒÆ’Ã¢â‚¬Å¡Ãƒâ€šÃ‚Â¼g</w:t>
+        <w:t>ÃƒÆ’Ã†â€™Ãƒâ€ Ã¢â‚¬â„¢ÃƒÆ’Ã¢â‚¬Â ÃƒÂ¢Ã¢â€šÂ¬Ã¢â€žÂ¢ÃƒÆ’Ã†â€™ÃƒÂ¢Ã¢â€šÂ¬Ã‚Â ÃƒÆ’Ã‚Â¢ÃƒÂ¢Ã¢â‚¬Å¡Ã‚Â¬ÃƒÂ¢Ã¢â‚¬Å¾Ã‚Â¢ÃƒÆ’Ã†â€™Ãƒâ€ Ã¢â‚¬â„¢ÃƒÆ’Ã‚Â¢ÃƒÂ¢Ã¢â‚¬Å¡Ã‚Â¬Ãƒâ€šÃ‚Â¦ÃƒÆ’Ã†â€™ÃƒÂ¢Ã¢â€šÂ¬Ã…Â¡ÃƒÆ’Ã¢â‚¬Å¡Ãƒâ€šÃ‚Â½ÃƒÆ’Ã†â€™Ãƒâ€ Ã¢â‚¬â„¢ÃƒÆ’Ã¢â‚¬Â ÃƒÂ¢Ã¢â€šÂ¬Ã¢â€žÂ¢ÃƒÆ’Ã†â€™Ãƒâ€šÃ‚Â¢ÃƒÆ’Ã‚Â¢ÃƒÂ¢Ã¢â€šÂ¬Ã…Â¡Ãƒâ€šÃ‚Â¬ÃƒÆ’Ã¢â‚¬Â¦Ãƒâ€šÃ‚Â¡ÃƒÆ’Ã†â€™Ãƒâ€ Ã¢â‚¬â„¢ÃƒÆ’Ã‚Â¢ÃƒÂ¢Ã¢â‚¬Å¡Ã‚Â¬Ãƒâ€¦Ã‚Â¡ÃƒÆ’Ã†â€™ÃƒÂ¢Ã¢â€šÂ¬Ã…Â¡ÃƒÆ’Ã¢â‚¬Å¡Ãƒâ€šÃ‚Â¼g</w:t>
       </w:r>
       <w:proofErr w:type="spellEnd"/>
       <w:r>
@@ -8276,7 +8276,7 @@
           <w:sz w:val="28"/>
           <w:szCs w:val="28"/>
         </w:rPr>
-        <w:t>ÃƒÆ’Ã†â€™Ãƒâ€ Ã¢â‚¬â„¢ÃƒÆ’Ã¢â‚¬Â ÃƒÂ¢Ã¢â€šÂ¬Ã¢â€žÂ¢ÃƒÆ’Ã†â€™ÃƒÂ¢Ã¢â€šÂ¬Ã‚Â¦ÃƒÆ’Ã¢â‚¬Å¡Ãƒâ€šÃ‚Â½ÃƒÆ’Ã†â€™Ãƒâ€ Ã¢â‚¬â„¢ÃƒÆ’Ã‚Â¢ÃƒÂ¢Ã¢â‚¬Å¡Ã‚Â¬Ãƒâ€¦Ã‚Â¡ÃƒÆ’Ã†â€™ÃƒÂ¢Ã¢â€šÂ¬Ã…Â¡ÃƒÆ’Ã¢â‚¬Å¡Ãƒâ€šÃ‚Â¼g</w:t>
+        <w:t>ÃƒÆ’Ã†â€™Ãƒâ€ Ã¢â‚¬â„¢ÃƒÆ’Ã¢â‚¬Â ÃƒÂ¢Ã¢â€šÂ¬Ã¢â€žÂ¢ÃƒÆ’Ã†â€™ÃƒÂ¢Ã¢â€šÂ¬Ã‚Â ÃƒÆ’Ã‚Â¢ÃƒÂ¢Ã¢â‚¬Å¡Ã‚Â¬ÃƒÂ¢Ã¢â‚¬Å¾Ã‚Â¢ÃƒÆ’Ã†â€™Ãƒâ€ Ã¢â‚¬â„¢ÃƒÆ’Ã‚Â¢ÃƒÂ¢Ã¢â‚¬Å¡Ã‚Â¬Ãƒâ€šÃ‚Â¦ÃƒÆ’Ã†â€™ÃƒÂ¢Ã¢â€šÂ¬Ã…Â¡ÃƒÆ’Ã¢â‚¬Å¡Ãƒâ€šÃ‚Â½ÃƒÆ’Ã†â€™Ãƒâ€ Ã¢â‚¬â„¢ÃƒÆ’Ã¢â‚¬Â ÃƒÂ¢Ã¢â€šÂ¬Ã¢â€žÂ¢ÃƒÆ’Ã†â€™Ãƒâ€šÃ‚Â¢ÃƒÆ’Ã‚Â¢ÃƒÂ¢Ã¢â€šÂ¬Ã…Â¡Ãƒâ€šÃ‚Â¬ÃƒÆ’Ã¢â‚¬Â¦Ãƒâ€šÃ‚Â¡ÃƒÆ’Ã†â€™Ãƒâ€ Ã¢â‚¬â„¢ÃƒÆ’Ã‚Â¢ÃƒÂ¢Ã¢â‚¬Å¡Ã‚Â¬Ãƒâ€¦Ã‚Â¡ÃƒÆ’Ã†â€™ÃƒÂ¢Ã¢â€šÂ¬Ã…Â¡ÃƒÆ’Ã¢â‚¬Å¡Ãƒâ€šÃ‚Â¼g</w:t>
       </w:r>
       <w:proofErr w:type="spellEnd"/>
       <w:r>
@@ -8406,7 +8406,7 @@
           <w:szCs w:val="28"/>
         </w:rPr>
         <w:lastRenderedPageBreak/>
-        <w:t xml:space="preserve">By Week 7, sodium nitrite concentrations in both treatments had declined and stabilized at very similar levels, approximately 73ÃƒÆ’Ã†â€™Ãƒâ€ Ã¢â‚¬â„¢ÃƒÆ’Ã¢â‚¬Â ÃƒÂ¢Ã¢â€šÂ¬Ã¢â€žÂ¢ÃƒÆ’Ã†â€™ÃƒÂ¢Ã¢â€šÂ¬Ã…Â¡ÃƒÆ’Ã¢â‚¬Å¡Ãƒâ€šÃ‚Â¢ÃƒÆ’Ã†â€™Ãƒâ€ Ã¢â‚¬â„¢ÃƒÆ’Ã¢â‚¬Å¡Ãƒâ€šÃ‚Â¢ÃƒÆ’Ã†â€™Ãƒâ€šÃ‚Â¢ÃƒÆ’Ã‚Â¢ÃƒÂ¢Ã¢â€šÂ¬Ã…Â¡Ãƒâ€šÃ‚Â¬ÃƒÆ’Ã¢â‚¬Â¦Ãƒâ€šÃ‚Â¡ÃƒÆ’Ã†â€™ÃƒÂ¢Ã¢â€šÂ¬Ã…Â¡ÃƒÆ’Ã¢â‚¬Å¡Ãƒâ€šÃ‚Â¬ÃƒÆ’Ã†â€™Ãƒâ€ Ã¢â‚¬â„¢ÃƒÆ’Ã¢â‚¬Å¡Ãƒâ€šÃ‚Â¢ÃƒÆ’Ã†â€™Ãƒâ€šÃ‚Â¢ÃƒÆ’Ã‚Â¢ÃƒÂ¢Ã¢â‚¬Å¡Ã‚Â¬Ãƒâ€¦Ã‚Â¡ÃƒÆ’Ã¢â‚¬Å¡Ãƒâ€šÃ‚Â¬ÃƒÆ’Ã†â€™ÃƒÂ¢Ã¢â€šÂ¬Ã‚Â¦ÃƒÆ’Ã‚Â¢ÃƒÂ¢Ã¢â‚¬Å¡Ã‚Â¬Ãƒâ€¦Ã¢â‚¬Å“74 </w:t>
+        <w:t xml:space="preserve">By Week 7, sodium nitrite concentrations in both treatments had declined and stabilized at very similar levels, approximately 73ÃƒÆ’Ã†â€™Ãƒâ€ Ã¢â‚¬â„¢ÃƒÆ’Ã¢â‚¬Â ÃƒÂ¢Ã¢â€šÂ¬Ã¢â€žÂ¢ÃƒÆ’Ã†â€™ÃƒÂ¢Ã¢â€šÂ¬Ã‚Â ÃƒÆ’Ã‚Â¢ÃƒÂ¢Ã¢â‚¬Å¡Ã‚Â¬ÃƒÂ¢Ã¢â‚¬Å¾Ã‚Â¢ÃƒÆ’Ã†â€™Ãƒâ€ Ã¢â‚¬â„¢ÃƒÆ’Ã‚Â¢ÃƒÂ¢Ã¢â‚¬Å¡Ã‚Â¬Ãƒâ€¦Ã‚Â¡ÃƒÆ’Ã†â€™ÃƒÂ¢Ã¢â€šÂ¬Ã…Â¡ÃƒÆ’Ã¢â‚¬Å¡Ãƒâ€šÃ‚Â¢ÃƒÆ’Ã†â€™Ãƒâ€ Ã¢â‚¬â„¢ÃƒÆ’Ã¢â‚¬Â ÃƒÂ¢Ã¢â€šÂ¬Ã¢â€žÂ¢ÃƒÆ’Ã†â€™ÃƒÂ¢Ã¢â€šÂ¬Ã…Â¡ÃƒÆ’Ã¢â‚¬Å¡Ãƒâ€šÃ‚Â¢ÃƒÆ’Ã†â€™Ãƒâ€ Ã¢â‚¬â„¢ÃƒÆ’Ã¢â‚¬Å¡Ãƒâ€šÃ‚Â¢ÃƒÆ’Ã†â€™Ãƒâ€šÃ‚Â¢ÃƒÆ’Ã‚Â¢ÃƒÂ¢Ã¢â‚¬Å¡Ã‚Â¬Ãƒâ€¦Ã‚Â¡ÃƒÆ’Ã¢â‚¬Å¡Ãƒâ€šÃ‚Â¬ÃƒÆ’Ã†â€™ÃƒÂ¢Ã¢â€šÂ¬Ã‚Â¦ÃƒÆ’Ã¢â‚¬Å¡Ãƒâ€šÃ‚Â¡ÃƒÆ’Ã†â€™Ãƒâ€ Ã¢â‚¬â„¢ÃƒÆ’Ã‚Â¢ÃƒÂ¢Ã¢â‚¬Å¡Ã‚Â¬Ãƒâ€¦Ã‚Â¡ÃƒÆ’Ã†â€™ÃƒÂ¢Ã¢â€šÂ¬Ã…Â¡ÃƒÆ’Ã¢â‚¬Å¡Ãƒâ€šÃ‚Â¬ÃƒÆ’Ã†â€™Ãƒâ€ Ã¢â‚¬â„¢ÃƒÆ’Ã¢â‚¬Â ÃƒÂ¢Ã¢â€šÂ¬Ã¢â€žÂ¢ÃƒÆ’Ã†â€™ÃƒÂ¢Ã¢â€šÂ¬Ã…Â¡ÃƒÆ’Ã¢â‚¬Å¡Ãƒâ€šÃ‚Â¢ÃƒÆ’Ã†â€™Ãƒâ€ Ã¢â‚¬â„¢ÃƒÆ’Ã¢â‚¬Å¡Ãƒâ€šÃ‚Â¢ÃƒÆ’Ã†â€™Ãƒâ€šÃ‚Â¢ÃƒÆ’Ã‚Â¢ÃƒÂ¢Ã¢â€šÂ¬Ã…Â¡Ãƒâ€šÃ‚Â¬ÃƒÆ’Ã¢â‚¬Â¦Ãƒâ€šÃ‚Â¡ÃƒÆ’Ã†â€™ÃƒÂ¢Ã¢â€šÂ¬Ã…Â¡ÃƒÆ’Ã¢â‚¬Å¡Ãƒâ€šÃ‚Â¬ÃƒÆ’Ã†â€™Ãƒâ€ Ã¢â‚¬â„¢ÃƒÆ’Ã‚Â¢ÃƒÂ¢Ã¢â‚¬Å¡Ã‚Â¬Ãƒâ€šÃ‚Â¦ÃƒÆ’Ã†â€™Ãƒâ€šÃ‚Â¢ÃƒÆ’Ã‚Â¢ÃƒÂ¢Ã¢â€šÂ¬Ã…Â¡Ãƒâ€šÃ‚Â¬ÃƒÆ’Ã¢â‚¬Â¦ÃƒÂ¢Ã¢â€šÂ¬Ã…â€œ74 </w:t>
       </w:r>
       <w:proofErr w:type="spellStart"/>
       <w:r>
@@ -8415,7 +8415,7 @@
           <w:sz w:val="28"/>
           <w:szCs w:val="28"/>
         </w:rPr>
-        <w:t>ÃƒÆ’Ã†â€™Ãƒâ€ Ã¢â‚¬â„¢ÃƒÆ’Ã¢â‚¬Â ÃƒÂ¢Ã¢â€šÂ¬Ã¢â€žÂ¢ÃƒÆ’Ã†â€™ÃƒÂ¢Ã¢â€šÂ¬Ã‚Â¦ÃƒÆ’Ã¢â‚¬Å¡Ãƒâ€šÃ‚Â½ÃƒÆ’Ã†â€™Ãƒâ€ Ã¢â‚¬â„¢ÃƒÆ’Ã‚Â¢ÃƒÂ¢Ã¢â‚¬Å¡Ã‚Â¬Ãƒâ€¦Ã‚Â¡ÃƒÆ’Ã†â€™ÃƒÂ¢Ã¢â€šÂ¬Ã…Â¡ÃƒÆ’Ã¢â‚¬Å¡Ãƒâ€šÃ‚Â¼g</w:t>
+        <w:t>ÃƒÆ’Ã†â€™Ãƒâ€ Ã¢â‚¬â„¢ÃƒÆ’Ã¢â‚¬Â ÃƒÂ¢Ã¢â€šÂ¬Ã¢â€žÂ¢ÃƒÆ’Ã†â€™ÃƒÂ¢Ã¢â€šÂ¬Ã‚Â ÃƒÆ’Ã‚Â¢ÃƒÂ¢Ã¢â‚¬Å¡Ã‚Â¬ÃƒÂ¢Ã¢â‚¬Å¾Ã‚Â¢ÃƒÆ’Ã†â€™Ãƒâ€ Ã¢â‚¬â„¢ÃƒÆ’Ã‚Â¢ÃƒÂ¢Ã¢â‚¬Å¡Ã‚Â¬Ãƒâ€šÃ‚Â¦ÃƒÆ’Ã†â€™ÃƒÂ¢Ã¢â€šÂ¬Ã…Â¡ÃƒÆ’Ã¢â‚¬Å¡Ãƒâ€šÃ‚Â½ÃƒÆ’Ã†â€™Ãƒâ€ Ã¢â‚¬â„¢ÃƒÆ’Ã¢â‚¬Â ÃƒÂ¢Ã¢â€šÂ¬Ã¢â€žÂ¢ÃƒÆ’Ã†â€™Ãƒâ€šÃ‚Â¢ÃƒÆ’Ã‚Â¢ÃƒÂ¢Ã¢â€šÂ¬Ã…Â¡Ãƒâ€šÃ‚Â¬ÃƒÆ’Ã¢â‚¬Â¦Ãƒâ€šÃ‚Â¡ÃƒÆ’Ã†â€™Ãƒâ€ Ã¢â‚¬â„¢ÃƒÆ’Ã‚Â¢ÃƒÂ¢Ã¢â‚¬Å¡Ã‚Â¬Ãƒâ€¦Ã‚Â¡ÃƒÆ’Ã†â€™ÃƒÂ¢Ã¢â€šÂ¬Ã…Â¡ÃƒÆ’Ã¢â‚¬Å¡Ãƒâ€šÃ‚Â¼g</w:t>
       </w:r>
       <w:proofErr w:type="spellEnd"/>
       <w:r>
@@ -8551,7 +8551,7 @@
           <w:szCs w:val="28"/>
         </w:rPr>
         <w:lastRenderedPageBreak/>
-        <w:t>The bar chart illustrates the changes in nitrite nitrogen (NOÃƒÆ’Ã†â€™Ãƒâ€ Ã¢â‚¬â„¢ÃƒÆ’Ã¢â‚¬Â ÃƒÂ¢Ã¢â€šÂ¬Ã¢â€žÂ¢ÃƒÆ’Ã†â€™ÃƒÂ¢Ã¢â€šÂ¬Ã…Â¡ÃƒÆ’Ã¢â‚¬Å¡Ãƒâ€šÃ‚Â¢ÃƒÆ’Ã†â€™Ãƒâ€ Ã¢â‚¬â„¢ÃƒÆ’Ã¢â‚¬Å¡Ãƒâ€šÃ‚Â¢ÃƒÆ’Ã†â€™Ãƒâ€šÃ‚Â¢ÃƒÆ’Ã‚Â¢ÃƒÂ¢Ã¢â‚¬Å¡Ã‚Â¬Ãƒâ€¦Ã‚Â¡ÃƒÆ’Ã¢â‚¬Å¡Ãƒâ€šÃ‚Â¬ÃƒÆ’Ã†â€™ÃƒÂ¢Ã¢â€šÂ¬Ã‚Â¦ÃƒÆ’Ã¢â‚¬Å¡Ãƒâ€šÃ‚Â¡ÃƒÆ’Ã†â€™Ãƒâ€ Ã¢â‚¬â„¢ÃƒÆ’Ã¢â‚¬Å¡Ãƒâ€šÃ‚Â¢ÃƒÆ’Ã†â€™Ãƒâ€šÃ‚Â¢ÃƒÆ’Ã‚Â¢ÃƒÂ¢Ã¢â‚¬Å¡Ã‚Â¬Ãƒâ€¦Ã‚Â¡ÃƒÆ’Ã¢â‚¬Å¡Ãƒâ€šÃ‚Â¬ÃƒÆ’Ã†â€™ÃƒÂ¢Ã¢â€šÂ¬Ã‚Â¦ÃƒÆ’Ã¢â‚¬Å¡Ãƒâ€šÃ‚Â¡ÃƒÆ’Ã†â€™Ãƒâ€ Ã¢â‚¬â„¢ÃƒÆ’Ã¢â‚¬Â ÃƒÂ¢Ã¢â€šÂ¬Ã¢â€žÂ¢ÃƒÆ’Ã†â€™ÃƒÂ¢Ã¢â€šÂ¬Ã…Â¡ÃƒÆ’Ã¢â‚¬Å¡Ãƒâ€šÃ‚Â¢ÃƒÆ’Ã†â€™Ãƒâ€ Ã¢â‚¬â„¢ÃƒÆ’Ã‚Â¢ÃƒÂ¢Ã¢â‚¬Å¡Ã‚Â¬Ãƒâ€¦Ã‚Â¡ÃƒÆ’Ã†â€™ÃƒÂ¢Ã¢â€šÂ¬Ã…Â¡ÃƒÆ’Ã¢â‚¬Å¡Ãƒâ€šÃ‚ÂÃƒÆ’Ã†â€™Ãƒâ€ Ã¢â‚¬â„¢ÃƒÆ’Ã‚Â¢ÃƒÂ¢Ã¢â‚¬Å¡Ã‚Â¬Ãƒâ€¦Ã‚Â¡ÃƒÆ’Ã†â€™ÃƒÂ¢Ã¢â€šÂ¬Ã…Â¡ÃƒÆ’Ã¢â‚¬Å¡Ãƒâ€šÃ‚Â»-N) concentration (</w:t>
+        <w:t>The bar chart illustrates the changes in nitrite nitrogen (NOÃƒÆ’Ã†â€™Ãƒâ€ Ã¢â‚¬â„¢ÃƒÆ’Ã¢â‚¬Â ÃƒÂ¢Ã¢â€šÂ¬Ã¢â€žÂ¢ÃƒÆ’Ã†â€™ÃƒÂ¢Ã¢â€šÂ¬Ã‚Â ÃƒÆ’Ã‚Â¢ÃƒÂ¢Ã¢â‚¬Å¡Ã‚Â¬ÃƒÂ¢Ã¢â‚¬Å¾Ã‚Â¢ÃƒÆ’Ã†â€™Ãƒâ€ Ã¢â‚¬â„¢ÃƒÆ’Ã‚Â¢ÃƒÂ¢Ã¢â‚¬Å¡Ã‚Â¬Ãƒâ€¦Ã‚Â¡ÃƒÆ’Ã†â€™ÃƒÂ¢Ã¢â€šÂ¬Ã…Â¡ÃƒÆ’Ã¢â‚¬Å¡Ãƒâ€šÃ‚Â¢ÃƒÆ’Ã†â€™Ãƒâ€ Ã¢â‚¬â„¢ÃƒÆ’Ã¢â‚¬Â ÃƒÂ¢Ã¢â€šÂ¬Ã¢â€žÂ¢ÃƒÆ’Ã†â€™ÃƒÂ¢Ã¢â€šÂ¬Ã…Â¡ÃƒÆ’Ã¢â‚¬Å¡Ãƒâ€šÃ‚Â¢ÃƒÆ’Ã†â€™Ãƒâ€ Ã¢â‚¬â„¢ÃƒÆ’Ã¢â‚¬Å¡Ãƒâ€šÃ‚Â¢ÃƒÆ’Ã†â€™Ãƒâ€šÃ‚Â¢ÃƒÆ’Ã‚Â¢ÃƒÂ¢Ã¢â€šÂ¬Ã…Â¡Ãƒâ€šÃ‚Â¬ÃƒÆ’Ã¢â‚¬Â¦Ãƒâ€šÃ‚Â¡ÃƒÆ’Ã†â€™ÃƒÂ¢Ã¢â€šÂ¬Ã…Â¡ÃƒÆ’Ã¢â‚¬Å¡Ãƒâ€šÃ‚Â¬ÃƒÆ’Ã†â€™Ãƒâ€ Ã¢â‚¬â„¢ÃƒÆ’Ã‚Â¢ÃƒÂ¢Ã¢â‚¬Å¡Ã‚Â¬Ãƒâ€šÃ‚Â¦ÃƒÆ’Ã†â€™ÃƒÂ¢Ã¢â€šÂ¬Ã…Â¡ÃƒÆ’Ã¢â‚¬Å¡Ãƒâ€šÃ‚Â¡ÃƒÆ’Ã†â€™Ãƒâ€ Ã¢â‚¬â„¢ÃƒÆ’Ã¢â‚¬Â ÃƒÂ¢Ã¢â€šÂ¬Ã¢â€žÂ¢ÃƒÆ’Ã†â€™ÃƒÂ¢Ã¢â€šÂ¬Ã…Â¡ÃƒÆ’Ã¢â‚¬Å¡Ãƒâ€šÃ‚Â¢ÃƒÆ’Ã†â€™Ãƒâ€ Ã¢â‚¬â„¢ÃƒÆ’Ã¢â‚¬Å¡Ãƒâ€šÃ‚Â¢ÃƒÆ’Ã†â€™Ãƒâ€šÃ‚Â¢ÃƒÆ’Ã‚Â¢ÃƒÂ¢Ã¢â€šÂ¬Ã…Â¡Ãƒâ€šÃ‚Â¬ÃƒÆ’Ã¢â‚¬Â¦Ãƒâ€šÃ‚Â¡ÃƒÆ’Ã†â€™ÃƒÂ¢Ã¢â€šÂ¬Ã…Â¡ÃƒÆ’Ã¢â‚¬Å¡Ãƒâ€šÃ‚Â¬ÃƒÆ’Ã†â€™Ãƒâ€ Ã¢â‚¬â„¢ÃƒÆ’Ã‚Â¢ÃƒÂ¢Ã¢â‚¬Å¡Ã‚Â¬Ãƒâ€šÃ‚Â¦ÃƒÆ’Ã†â€™ÃƒÂ¢Ã¢â€šÂ¬Ã…Â¡ÃƒÆ’Ã¢â‚¬Å¡Ãƒâ€šÃ‚Â¡ÃƒÆ’Ã†â€™Ãƒâ€ Ã¢â‚¬â„¢ÃƒÆ’Ã¢â‚¬Â ÃƒÂ¢Ã¢â€šÂ¬Ã¢â€žÂ¢ÃƒÆ’Ã†â€™ÃƒÂ¢Ã¢â€šÂ¬Ã‚Â ÃƒÆ’Ã‚Â¢ÃƒÂ¢Ã¢â‚¬Å¡Ã‚Â¬ÃƒÂ¢Ã¢â‚¬Å¾Ã‚Â¢ÃƒÆ’Ã†â€™Ãƒâ€ Ã¢â‚¬â„¢ÃƒÆ’Ã‚Â¢ÃƒÂ¢Ã¢â‚¬Å¡Ã‚Â¬Ãƒâ€¦Ã‚Â¡ÃƒÆ’Ã†â€™ÃƒÂ¢Ã¢â€šÂ¬Ã…Â¡ÃƒÆ’Ã¢â‚¬Å¡Ãƒâ€šÃ‚Â¢ÃƒÆ’Ã†â€™Ãƒâ€ Ã¢â‚¬â„¢ÃƒÆ’Ã¢â‚¬Â ÃƒÂ¢Ã¢â€šÂ¬Ã¢â€žÂ¢ÃƒÆ’Ã†â€™Ãƒâ€šÃ‚Â¢ÃƒÆ’Ã‚Â¢ÃƒÂ¢Ã¢â€šÂ¬Ã…Â¡Ãƒâ€šÃ‚Â¬ÃƒÆ’Ã¢â‚¬Â¦Ãƒâ€šÃ‚Â¡ÃƒÆ’Ã†â€™Ãƒâ€ Ã¢â‚¬â„¢ÃƒÆ’Ã‚Â¢ÃƒÂ¢Ã¢â‚¬Å¡Ã‚Â¬Ãƒâ€¦Ã‚Â¡ÃƒÆ’Ã†â€™ÃƒÂ¢Ã¢â€šÂ¬Ã…Â¡ÃƒÆ’Ã¢â‚¬Å¡Ãƒâ€šÃ‚ÂÃƒÆ’Ã†â€™Ãƒâ€ Ã¢â‚¬â„¢ÃƒÆ’Ã¢â‚¬Â ÃƒÂ¢Ã¢â€šÂ¬Ã¢â€žÂ¢ÃƒÆ’Ã†â€™Ãƒâ€šÃ‚Â¢ÃƒÆ’Ã‚Â¢ÃƒÂ¢Ã¢â€šÂ¬Ã…Â¡Ãƒâ€šÃ‚Â¬ÃƒÆ’Ã¢â‚¬Â¦Ãƒâ€šÃ‚Â¡ÃƒÆ’Ã†â€™Ãƒâ€ Ã¢â‚¬â„¢ÃƒÆ’Ã‚Â¢ÃƒÂ¢Ã¢â‚¬Å¡Ã‚Â¬Ãƒâ€¦Ã‚Â¡ÃƒÆ’Ã†â€™ÃƒÂ¢Ã¢â€šÂ¬Ã…Â¡ÃƒÆ’Ã¢â‚¬Å¡Ãƒâ€šÃ‚Â»-N) concentration (</w:t>
       </w:r>
       <w:proofErr w:type="spellStart"/>
       <w:r>
@@ -8560,7 +8560,7 @@
           <w:sz w:val="28"/>
           <w:szCs w:val="28"/>
         </w:rPr>
-        <w:t>ÃƒÆ’Ã†â€™Ãƒâ€ Ã¢â‚¬â„¢ÃƒÆ’Ã¢â‚¬Â ÃƒÂ¢Ã¢â€šÂ¬Ã¢â€žÂ¢ÃƒÆ’Ã†â€™ÃƒÂ¢Ã¢â€šÂ¬Ã‚Â¦ÃƒÆ’Ã¢â‚¬Å¡Ãƒâ€šÃ‚Â½ÃƒÆ’Ã†â€™Ãƒâ€ Ã¢â‚¬â„¢ÃƒÆ’Ã‚Â¢ÃƒÂ¢Ã¢â‚¬Å¡Ã‚Â¬Ãƒâ€¦Ã‚Â¡ÃƒÆ’Ã†â€™ÃƒÂ¢Ã¢â€šÂ¬Ã…Â¡ÃƒÆ’Ã¢â‚¬Å¡Ãƒâ€šÃ‚Â¼g</w:t>
+        <w:t>ÃƒÆ’Ã†â€™Ãƒâ€ Ã¢â‚¬â„¢ÃƒÆ’Ã¢â‚¬Â ÃƒÂ¢Ã¢â€šÂ¬Ã¢â€žÂ¢ÃƒÆ’Ã†â€™ÃƒÂ¢Ã¢â€šÂ¬Ã‚Â ÃƒÆ’Ã‚Â¢ÃƒÂ¢Ã¢â‚¬Å¡Ã‚Â¬ÃƒÂ¢Ã¢â‚¬Å¾Ã‚Â¢ÃƒÆ’Ã†â€™Ãƒâ€ Ã¢â‚¬â„¢ÃƒÆ’Ã‚Â¢ÃƒÂ¢Ã¢â‚¬Å¡Ã‚Â¬Ãƒâ€šÃ‚Â¦ÃƒÆ’Ã†â€™ÃƒÂ¢Ã¢â€šÂ¬Ã…Â¡ÃƒÆ’Ã¢â‚¬Å¡Ãƒâ€šÃ‚Â½ÃƒÆ’Ã†â€™Ãƒâ€ Ã¢â‚¬â„¢ÃƒÆ’Ã¢â‚¬Â ÃƒÂ¢Ã¢â€šÂ¬Ã¢â€žÂ¢ÃƒÆ’Ã†â€™Ãƒâ€šÃ‚Â¢ÃƒÆ’Ã‚Â¢ÃƒÂ¢Ã¢â€šÂ¬Ã…Â¡Ãƒâ€šÃ‚Â¬ÃƒÆ’Ã¢â‚¬Â¦Ãƒâ€šÃ‚Â¡ÃƒÆ’Ã†â€™Ãƒâ€ Ã¢â‚¬â„¢ÃƒÆ’Ã‚Â¢ÃƒÂ¢Ã¢â‚¬Å¡Ã‚Â¬Ãƒâ€¦Ã‚Â¡ÃƒÆ’Ã†â€™ÃƒÂ¢Ã¢â€šÂ¬Ã…Â¡ÃƒÆ’Ã¢â‚¬Å¡Ãƒâ€šÃ‚Â¼g</w:t>
       </w:r>
       <w:proofErr w:type="spellEnd"/>
       <w:r>
@@ -8578,7 +8578,7 @@
           <w:sz w:val="28"/>
           <w:szCs w:val="28"/>
         </w:rPr>
-        <w:t>ÃƒÆ’Ã†â€™Ãƒâ€ Ã¢â‚¬â„¢ÃƒÆ’Ã¢â‚¬Â ÃƒÂ¢Ã¢â€šÂ¬Ã¢â€žÂ¢ÃƒÆ’Ã†â€™ÃƒÂ¢Ã¢â€šÂ¬Ã‚Â¦ÃƒÆ’Ã¢â‚¬Å¡Ãƒâ€šÃ‚Â½ÃƒÆ’Ã†â€™Ãƒâ€ Ã¢â‚¬â„¢ÃƒÆ’Ã‚Â¢ÃƒÂ¢Ã¢â‚¬Å¡Ã‚Â¬Ãƒâ€¦Ã‚Â¡ÃƒÆ’Ã†â€™ÃƒÂ¢Ã¢â€šÂ¬Ã…Â¡ÃƒÆ’Ã¢â‚¬Å¡Ãƒâ€šÃ‚Â¼g</w:t>
+        <w:t>ÃƒÆ’Ã†â€™Ãƒâ€ Ã¢â‚¬â„¢ÃƒÆ’Ã¢â‚¬Â ÃƒÂ¢Ã¢â€šÂ¬Ã¢â€žÂ¢ÃƒÆ’Ã†â€™ÃƒÂ¢Ã¢â€šÂ¬Ã‚Â ÃƒÆ’Ã‚Â¢ÃƒÂ¢Ã¢â‚¬Å¡Ã‚Â¬ÃƒÂ¢Ã¢â‚¬Å¾Ã‚Â¢ÃƒÆ’Ã†â€™Ãƒâ€ Ã¢â‚¬â„¢ÃƒÆ’Ã‚Â¢ÃƒÂ¢Ã¢â‚¬Å¡Ã‚Â¬Ãƒâ€šÃ‚Â¦ÃƒÆ’Ã†â€™ÃƒÂ¢Ã¢â€šÂ¬Ã…Â¡ÃƒÆ’Ã¢â‚¬Å¡Ãƒâ€šÃ‚Â½ÃƒÆ’Ã†â€™Ãƒâ€ Ã¢â‚¬â„¢ÃƒÆ’Ã¢â‚¬Â ÃƒÂ¢Ã¢â€šÂ¬Ã¢â€žÂ¢ÃƒÆ’Ã†â€™Ãƒâ€šÃ‚Â¢ÃƒÆ’Ã‚Â¢ÃƒÂ¢Ã¢â€šÂ¬Ã…Â¡Ãƒâ€šÃ‚Â¬ÃƒÆ’Ã¢â‚¬Â¦Ãƒâ€šÃ‚Â¡ÃƒÆ’Ã†â€™Ãƒâ€ Ã¢â‚¬â„¢ÃƒÆ’Ã‚Â¢ÃƒÂ¢Ã¢â‚¬Å¡Ã‚Â¬Ãƒâ€¦Ã‚Â¡ÃƒÆ’Ã†â€™ÃƒÂ¢Ã¢â€šÂ¬Ã…Â¡ÃƒÆ’Ã¢â‚¬Å¡Ãƒâ€šÃ‚Â¼g</w:t>
       </w:r>
       <w:proofErr w:type="spellEnd"/>
       <w:r>
@@ -8596,7 +8596,7 @@
           <w:sz w:val="28"/>
           <w:szCs w:val="28"/>
         </w:rPr>
-        <w:t>ÃƒÆ’Ã†â€™Ãƒâ€ Ã¢â‚¬â„¢ÃƒÆ’Ã¢â‚¬Â ÃƒÂ¢Ã¢â€šÂ¬Ã¢â€žÂ¢ÃƒÆ’Ã†â€™ÃƒÂ¢Ã¢â€šÂ¬Ã‚Â¦ÃƒÆ’Ã¢â‚¬Å¡Ãƒâ€šÃ‚Â½ÃƒÆ’Ã†â€™Ãƒâ€ Ã¢â‚¬â„¢ÃƒÆ’Ã‚Â¢ÃƒÂ¢Ã¢â‚¬Å¡Ã‚Â¬Ãƒâ€¦Ã‚Â¡ÃƒÆ’Ã†â€™ÃƒÂ¢Ã¢â€šÂ¬Ã…Â¡ÃƒÆ’Ã¢â‚¬Å¡Ãƒâ€šÃ‚Â¼g</w:t>
+        <w:t>ÃƒÆ’Ã†â€™Ãƒâ€ Ã¢â‚¬â„¢ÃƒÆ’Ã¢â‚¬Â ÃƒÂ¢Ã¢â€šÂ¬Ã¢â€žÂ¢ÃƒÆ’Ã†â€™ÃƒÂ¢Ã¢â€šÂ¬Ã‚Â ÃƒÆ’Ã‚Â¢ÃƒÂ¢Ã¢â‚¬Å¡Ã‚Â¬ÃƒÂ¢Ã¢â‚¬Å¾Ã‚Â¢ÃƒÆ’Ã†â€™Ãƒâ€ Ã¢â‚¬â„¢ÃƒÆ’Ã‚Â¢ÃƒÂ¢Ã¢â‚¬Å¡Ã‚Â¬Ãƒâ€šÃ‚Â¦ÃƒÆ’Ã†â€™ÃƒÂ¢Ã¢â€šÂ¬Ã…Â¡ÃƒÆ’Ã¢â‚¬Å¡Ãƒâ€šÃ‚Â½ÃƒÆ’Ã†â€™Ãƒâ€ Ã¢â‚¬â„¢ÃƒÆ’Ã¢â‚¬Â ÃƒÂ¢Ã¢â€šÂ¬Ã¢â€žÂ¢ÃƒÆ’Ã†â€™Ãƒâ€šÃ‚Â¢ÃƒÆ’Ã‚Â¢ÃƒÂ¢Ã¢â€šÂ¬Ã…Â¡Ãƒâ€šÃ‚Â¬ÃƒÆ’Ã¢â‚¬Â¦Ãƒâ€šÃ‚Â¡ÃƒÆ’Ã†â€™Ãƒâ€ Ã¢â‚¬â„¢ÃƒÆ’Ã‚Â¢ÃƒÂ¢Ã¢â‚¬Å¡Ã‚Â¬Ãƒâ€¦Ã‚Â¡ÃƒÆ’Ã†â€™ÃƒÂ¢Ã¢â€šÂ¬Ã…Â¡ÃƒÆ’Ã¢â‚¬Å¡Ãƒâ€šÃ‚Â¼g</w:t>
       </w:r>
       <w:proofErr w:type="spellEnd"/>
       <w:r>
@@ -8632,7 +8632,7 @@
           <w:sz w:val="28"/>
           <w:szCs w:val="28"/>
         </w:rPr>
-        <w:t>ÃƒÆ’Ã†â€™Ãƒâ€ Ã¢â‚¬â„¢ÃƒÆ’Ã¢â‚¬Â ÃƒÂ¢Ã¢â€šÂ¬Ã¢â€žÂ¢ÃƒÆ’Ã†â€™ÃƒÂ¢Ã¢â€šÂ¬Ã‚Â¦ÃƒÆ’Ã¢â‚¬Å¡Ãƒâ€šÃ‚Â½ÃƒÆ’Ã†â€™Ãƒâ€ Ã¢â‚¬â„¢ÃƒÆ’Ã‚Â¢ÃƒÂ¢Ã¢â‚¬Å¡Ã‚Â¬Ãƒâ€¦Ã‚Â¡ÃƒÆ’Ã†â€™ÃƒÂ¢Ã¢â€šÂ¬Ã…Â¡ÃƒÆ’Ã¢â‚¬Å¡Ãƒâ€šÃ‚Â¼g</w:t>
+        <w:t>ÃƒÆ’Ã†â€™Ãƒâ€ Ã¢â‚¬â„¢ÃƒÆ’Ã¢â‚¬Â ÃƒÂ¢Ã¢â€šÂ¬Ã¢â€žÂ¢ÃƒÆ’Ã†â€™ÃƒÂ¢Ã¢â€šÂ¬Ã‚Â ÃƒÆ’Ã‚Â¢ÃƒÂ¢Ã¢â‚¬Å¡Ã‚Â¬ÃƒÂ¢Ã¢â‚¬Å¾Ã‚Â¢ÃƒÆ’Ã†â€™Ãƒâ€ Ã¢â‚¬â„¢ÃƒÆ’Ã‚Â¢ÃƒÂ¢Ã¢â‚¬Å¡Ã‚Â¬Ãƒâ€šÃ‚Â¦ÃƒÆ’Ã†â€™ÃƒÂ¢Ã¢â€šÂ¬Ã…Â¡ÃƒÆ’Ã¢â‚¬Å¡Ãƒâ€šÃ‚Â½ÃƒÆ’Ã†â€™Ãƒâ€ Ã¢â‚¬â„¢ÃƒÆ’Ã¢â‚¬Â ÃƒÂ¢Ã¢â€šÂ¬Ã¢â€žÂ¢ÃƒÆ’Ã†â€™Ãƒâ€šÃ‚Â¢ÃƒÆ’Ã‚Â¢ÃƒÂ¢Ã¢â€šÂ¬Ã…Â¡Ãƒâ€šÃ‚Â¬ÃƒÆ’Ã¢â‚¬Â¦Ãƒâ€šÃ‚Â¡ÃƒÆ’Ã†â€™Ãƒâ€ Ã¢â‚¬â„¢ÃƒÆ’Ã‚Â¢ÃƒÂ¢Ã¢â‚¬Å¡Ã‚Â¬Ãƒâ€¦Ã‚Â¡ÃƒÆ’Ã†â€™ÃƒÂ¢Ã¢â€šÂ¬Ã…Â¡ÃƒÆ’Ã¢â‚¬Å¡Ãƒâ€šÃ‚Â¼g</w:t>
       </w:r>
       <w:proofErr w:type="spellEnd"/>
       <w:r>
@@ -8887,7 +8887,7 @@
           <w:sz w:val="28"/>
           <w:szCs w:val="28"/>
         </w:rPr>
-        <w:t>The bar chart illustrates the changes in phosphate (POÃƒÆ’Ã†â€™Ãƒâ€ Ã¢â‚¬â„¢ÃƒÆ’Ã¢â‚¬Â ÃƒÂ¢Ã¢â€šÂ¬Ã¢â€žÂ¢ÃƒÆ’Ã†â€™ÃƒÂ¢Ã¢â€šÂ¬Ã…Â¡ÃƒÆ’Ã¢â‚¬Å¡Ãƒâ€šÃ‚Â¢ÃƒÆ’Ã†â€™Ãƒâ€ Ã¢â‚¬â„¢ÃƒÆ’Ã¢â‚¬Å¡Ãƒâ€šÃ‚Â¢ÃƒÆ’Ã†â€™Ãƒâ€šÃ‚Â¢ÃƒÆ’Ã‚Â¢ÃƒÂ¢Ã¢â‚¬Å¡Ã‚Â¬Ãƒâ€¦Ã‚Â¡ÃƒÆ’Ã¢â‚¬Å¡Ãƒâ€šÃ‚Â¬ÃƒÆ’Ã†â€™ÃƒÂ¢Ã¢â€šÂ¬Ã‚Â¦ÃƒÆ’Ã¢â‚¬Å¡Ãƒâ€šÃ‚Â¡ÃƒÆ’Ã†â€™Ãƒâ€ Ã¢â‚¬â„¢ÃƒÆ’Ã¢â‚¬Å¡Ãƒâ€šÃ‚Â¢ÃƒÆ’Ã†â€™Ãƒâ€šÃ‚Â¢ÃƒÆ’Ã‚Â¢ÃƒÂ¢Ã¢â‚¬Å¡Ã‚Â¬Ãƒâ€¦Ã‚Â¡ÃƒÆ’Ã¢â‚¬Å¡Ãƒâ€šÃ‚Â¬ÃƒÆ’Ã†â€™ÃƒÂ¢Ã¢â€šÂ¬Ã‚Â¦ÃƒÆ’Ã¢â‚¬Å¡Ãƒâ€šÃ‚Â¾ÃƒÆ’Ã†â€™Ãƒâ€ Ã¢â‚¬â„¢ÃƒÆ’Ã¢â‚¬Â ÃƒÂ¢Ã¢â€šÂ¬Ã¢â€žÂ¢ÃƒÆ’Ã†â€™Ãƒâ€šÃ‚Â¢ÃƒÆ’Ã‚Â¢ÃƒÂ¢Ã¢â€šÂ¬Ã…Â¡Ãƒâ€šÃ‚Â¬ÃƒÆ’Ã¢â‚¬Â¦Ãƒâ€šÃ‚Â¡ÃƒÆ’Ã†â€™Ãƒâ€ Ã¢â‚¬â„¢ÃƒÆ’Ã‚Â¢ÃƒÂ¢Ã¢â‚¬Å¡Ã‚Â¬Ãƒâ€¦Ã‚Â¡ÃƒÆ’Ã†â€™ÃƒÂ¢Ã¢â€šÂ¬Ã…Â¡ÃƒÆ’Ã¢â‚¬Å¡Ãƒâ€šÃ‚Â³ÃƒÆ’Ã†â€™Ãƒâ€ Ã¢â‚¬â„¢ÃƒÆ’Ã¢â‚¬Â ÃƒÂ¢Ã¢â€šÂ¬Ã¢â€žÂ¢ÃƒÆ’Ã†â€™ÃƒÂ¢Ã¢â€šÂ¬Ã…Â¡ÃƒÆ’Ã¢â‚¬Å¡Ãƒâ€šÃ‚Â¢ÃƒÆ’Ã†â€™Ãƒâ€ Ã¢â‚¬â„¢ÃƒÆ’Ã‚Â¢ÃƒÂ¢Ã¢â‚¬Å¡Ã‚Â¬Ãƒâ€¦Ã‚Â¡ÃƒÆ’Ã†â€™ÃƒÂ¢Ã¢â€šÂ¬Ã…Â¡ÃƒÆ’Ã¢â‚¬Å¡Ãƒâ€šÃ‚ÂÃƒÆ’Ã†â€™Ãƒâ€ Ã¢â‚¬â„¢ÃƒÆ’Ã‚Â¢ÃƒÂ¢Ã¢â‚¬Å¡Ã‚Â¬Ãƒâ€¦Ã‚Â¡ÃƒÆ’Ã†â€™ÃƒÂ¢Ã¢â€šÂ¬Ã…Â¡ÃƒÆ’Ã¢â‚¬Å¡Ãƒâ€šÃ‚Â») concentration (</w:t>
+        <w:t>The bar chart illustrates the changes in phosphate (POÃƒÆ’Ã†â€™Ãƒâ€ Ã¢â‚¬â„¢ÃƒÆ’Ã¢â‚¬Â ÃƒÂ¢Ã¢â€šÂ¬Ã¢â€žÂ¢ÃƒÆ’Ã†â€™ÃƒÂ¢Ã¢â€šÂ¬Ã‚Â ÃƒÆ’Ã‚Â¢ÃƒÂ¢Ã¢â‚¬Å¡Ã‚Â¬ÃƒÂ¢Ã¢â‚¬Å¾Ã‚Â¢ÃƒÆ’Ã†â€™Ãƒâ€ Ã¢â‚¬â„¢ÃƒÆ’Ã‚Â¢ÃƒÂ¢Ã¢â‚¬Å¡Ã‚Â¬Ãƒâ€¦Ã‚Â¡ÃƒÆ’Ã†â€™ÃƒÂ¢Ã¢â€šÂ¬Ã…Â¡ÃƒÆ’Ã¢â‚¬Å¡Ãƒâ€šÃ‚Â¢ÃƒÆ’Ã†â€™Ãƒâ€ Ã¢â‚¬â„¢ÃƒÆ’Ã¢â‚¬Â ÃƒÂ¢Ã¢â€šÂ¬Ã¢â€žÂ¢ÃƒÆ’Ã†â€™ÃƒÂ¢Ã¢â€šÂ¬Ã…Â¡ÃƒÆ’Ã¢â‚¬Å¡Ãƒâ€šÃ‚Â¢ÃƒÆ’Ã†â€™Ãƒâ€ Ã¢â‚¬â„¢ÃƒÆ’Ã¢â‚¬Å¡Ãƒâ€šÃ‚Â¢ÃƒÆ’Ã†â€™Ãƒâ€šÃ‚Â¢ÃƒÆ’Ã‚Â¢ÃƒÂ¢Ã¢â€šÂ¬Ã…Â¡Ãƒâ€šÃ‚Â¬ÃƒÆ’Ã¢â‚¬Â¦Ãƒâ€šÃ‚Â¡ÃƒÆ’Ã†â€™ÃƒÂ¢Ã¢â€šÂ¬Ã…Â¡ÃƒÆ’Ã¢â‚¬Å¡Ãƒâ€šÃ‚Â¬ÃƒÆ’Ã†â€™Ãƒâ€ Ã¢â‚¬â„¢ÃƒÆ’Ã‚Â¢ÃƒÂ¢Ã¢â‚¬Å¡Ã‚Â¬Ãƒâ€šÃ‚Â¦ÃƒÆ’Ã†â€™ÃƒÂ¢Ã¢â€šÂ¬Ã…Â¡ÃƒÆ’Ã¢â‚¬Å¡Ãƒâ€šÃ‚Â¡ÃƒÆ’Ã†â€™Ãƒâ€ Ã¢â‚¬â„¢ÃƒÆ’Ã¢â‚¬Â ÃƒÂ¢Ã¢â€šÂ¬Ã¢â€žÂ¢ÃƒÆ’Ã†â€™ÃƒÂ¢Ã¢â€šÂ¬Ã…Â¡ÃƒÆ’Ã¢â‚¬Å¡Ãƒâ€šÃ‚Â¢ÃƒÆ’Ã†â€™Ãƒâ€ Ã¢â‚¬â„¢ÃƒÆ’Ã¢â‚¬Å¡Ãƒâ€šÃ‚Â¢ÃƒÆ’Ã†â€™Ãƒâ€šÃ‚Â¢ÃƒÆ’Ã‚Â¢ÃƒÂ¢Ã¢â€šÂ¬Ã…Â¡Ãƒâ€šÃ‚Â¬ÃƒÆ’Ã¢â‚¬Â¦Ãƒâ€šÃ‚Â¡ÃƒÆ’Ã†â€™ÃƒÂ¢Ã¢â€šÂ¬Ã…Â¡ÃƒÆ’Ã¢â‚¬Å¡Ãƒâ€šÃ‚Â¬ÃƒÆ’Ã†â€™Ãƒâ€ Ã¢â‚¬â„¢ÃƒÆ’Ã‚Â¢ÃƒÂ¢Ã¢â‚¬Å¡Ã‚Â¬Ãƒâ€šÃ‚Â¦ÃƒÆ’Ã†â€™ÃƒÂ¢Ã¢â€šÂ¬Ã…Â¡ÃƒÆ’Ã¢â‚¬Å¡Ãƒâ€šÃ‚Â¾ÃƒÆ’Ã†â€™Ãƒâ€ Ã¢â‚¬â„¢ÃƒÆ’Ã¢â‚¬Â ÃƒÂ¢Ã¢â€šÂ¬Ã¢â€žÂ¢ÃƒÆ’Ã†â€™ÃƒÂ¢Ã¢â€šÂ¬Ã‚Â ÃƒÆ’Ã‚Â¢ÃƒÂ¢Ã¢â‚¬Å¡Ã‚Â¬ÃƒÂ¢Ã¢â‚¬Å¾Ã‚Â¢ÃƒÆ’Ã†â€™Ãƒâ€ Ã¢â‚¬â„¢ÃƒÆ’Ã¢â‚¬Å¡Ãƒâ€šÃ‚Â¢ÃƒÆ’Ã†â€™Ãƒâ€šÃ‚Â¢ÃƒÆ’Ã‚Â¢ÃƒÂ¢Ã¢â‚¬Å¡Ã‚Â¬Ãƒâ€¦Ã‚Â¡ÃƒÆ’Ã¢â‚¬Å¡Ãƒâ€šÃ‚Â¬ÃƒÆ’Ã†â€™ÃƒÂ¢Ã¢â€šÂ¬Ã‚Â¦ÃƒÆ’Ã¢â‚¬Å¡Ãƒâ€šÃ‚Â¡ÃƒÆ’Ã†â€™Ãƒâ€ Ã¢â‚¬â„¢ÃƒÆ’Ã¢â‚¬Â ÃƒÂ¢Ã¢â€šÂ¬Ã¢â€žÂ¢ÃƒÆ’Ã†â€™Ãƒâ€šÃ‚Â¢ÃƒÆ’Ã‚Â¢ÃƒÂ¢Ã¢â€šÂ¬Ã…Â¡Ãƒâ€šÃ‚Â¬ÃƒÆ’Ã¢â‚¬Â¦Ãƒâ€šÃ‚Â¡ÃƒÆ’Ã†â€™Ãƒâ€ Ã¢â‚¬â„¢ÃƒÆ’Ã‚Â¢ÃƒÂ¢Ã¢â‚¬Å¡Ã‚Â¬Ãƒâ€¦Ã‚Â¡ÃƒÆ’Ã†â€™ÃƒÂ¢Ã¢â€šÂ¬Ã…Â¡ÃƒÆ’Ã¢â‚¬Å¡Ãƒâ€šÃ‚Â³ÃƒÆ’Ã†â€™Ãƒâ€ Ã¢â‚¬â„¢ÃƒÆ’Ã¢â‚¬Â ÃƒÂ¢Ã¢â€šÂ¬Ã¢â€žÂ¢ÃƒÆ’Ã†â€™ÃƒÂ¢Ã¢â€šÂ¬Ã‚Â ÃƒÆ’Ã‚Â¢ÃƒÂ¢Ã¢â‚¬Å¡Ã‚Â¬ÃƒÂ¢Ã¢â‚¬Å¾Ã‚Â¢ÃƒÆ’Ã†â€™Ãƒâ€ Ã¢â‚¬â„¢ÃƒÆ’Ã‚Â¢ÃƒÂ¢Ã¢â‚¬Å¡Ã‚Â¬Ãƒâ€¦Ã‚Â¡ÃƒÆ’Ã†â€™ÃƒÂ¢Ã¢â€šÂ¬Ã…Â¡ÃƒÆ’Ã¢â‚¬Å¡Ãƒâ€šÃ‚Â¢ÃƒÆ’Ã†â€™Ãƒâ€ Ã¢â‚¬â„¢ÃƒÆ’Ã¢â‚¬Â ÃƒÂ¢Ã¢â€šÂ¬Ã¢â€žÂ¢ÃƒÆ’Ã†â€™Ãƒâ€šÃ‚Â¢ÃƒÆ’Ã‚Â¢ÃƒÂ¢Ã¢â€šÂ¬Ã…Â¡Ãƒâ€šÃ‚Â¬ÃƒÆ’Ã¢â‚¬Â¦Ãƒâ€šÃ‚Â¡ÃƒÆ’Ã†â€™Ãƒâ€ Ã¢â‚¬â„¢ÃƒÆ’Ã‚Â¢ÃƒÂ¢Ã¢â‚¬Å¡Ã‚Â¬Ãƒâ€¦Ã‚Â¡ÃƒÆ’Ã†â€™ÃƒÂ¢Ã¢â€šÂ¬Ã…Â¡ÃƒÆ’Ã¢â‚¬Å¡Ãƒâ€šÃ‚ÂÃƒÆ’Ã†â€™Ãƒâ€ Ã¢â‚¬â„¢ÃƒÆ’Ã¢â‚¬Â ÃƒÂ¢Ã¢â€šÂ¬Ã¢â€žÂ¢ÃƒÆ’Ã†â€™Ãƒâ€šÃ‚Â¢ÃƒÆ’Ã‚Â¢ÃƒÂ¢Ã¢â€šÂ¬Ã…Â¡Ãƒâ€šÃ‚Â¬ÃƒÆ’Ã¢â‚¬Â¦Ãƒâ€šÃ‚Â¡ÃƒÆ’Ã†â€™Ãƒâ€ Ã¢â‚¬â„¢ÃƒÆ’Ã‚Â¢ÃƒÂ¢Ã¢â‚¬Å¡Ã‚Â¬Ãƒâ€¦Ã‚Â¡ÃƒÆ’Ã†â€™ÃƒÂ¢Ã¢â€šÂ¬Ã…Â¡ÃƒÆ’Ã¢â‚¬Å¡Ãƒâ€šÃ‚Â») concentration (</w:t>
       </w:r>
       <w:proofErr w:type="spellStart"/>
       <w:r>
@@ -8896,7 +8896,7 @@
           <w:sz w:val="28"/>
           <w:szCs w:val="28"/>
         </w:rPr>
-        <w:t>ÃƒÆ’Ã†â€™Ãƒâ€ Ã¢â‚¬â„¢ÃƒÆ’Ã¢â‚¬Â ÃƒÂ¢Ã¢â€šÂ¬Ã¢â€žÂ¢ÃƒÆ’Ã†â€™ÃƒÂ¢Ã¢â€šÂ¬Ã‚Â¦ÃƒÆ’Ã¢â‚¬Å¡Ãƒâ€šÃ‚Â½ÃƒÆ’Ã†â€™Ãƒâ€ Ã¢â‚¬â„¢ÃƒÆ’Ã‚Â¢ÃƒÂ¢Ã¢â‚¬Å¡Ã‚Â¬Ãƒâ€¦Ã‚Â¡ÃƒÆ’Ã†â€™ÃƒÂ¢Ã¢â€šÂ¬Ã…Â¡ÃƒÆ’Ã¢â‚¬Å¡Ãƒâ€šÃ‚Â¼g</w:t>
+        <w:t>ÃƒÆ’Ã†â€™Ãƒâ€ Ã¢â‚¬â„¢ÃƒÆ’Ã¢â‚¬Â ÃƒÂ¢Ã¢â€šÂ¬Ã¢â€žÂ¢ÃƒÆ’Ã†â€™ÃƒÂ¢Ã¢â€šÂ¬Ã‚Â ÃƒÆ’Ã‚Â¢ÃƒÂ¢Ã¢â‚¬Å¡Ã‚Â¬ÃƒÂ¢Ã¢â‚¬Å¾Ã‚Â¢ÃƒÆ’Ã†â€™Ãƒâ€ Ã¢â‚¬â„¢ÃƒÆ’Ã‚Â¢ÃƒÂ¢Ã¢â‚¬Å¡Ã‚Â¬Ãƒâ€šÃ‚Â¦ÃƒÆ’Ã†â€™ÃƒÂ¢Ã¢â€šÂ¬Ã…Â¡ÃƒÆ’Ã¢â‚¬Å¡Ãƒâ€šÃ‚Â½ÃƒÆ’Ã†â€™Ãƒâ€ Ã¢â‚¬â„¢ÃƒÆ’Ã¢â‚¬Â ÃƒÂ¢Ã¢â€šÂ¬Ã¢â€žÂ¢ÃƒÆ’Ã†â€™Ãƒâ€šÃ‚Â¢ÃƒÆ’Ã‚Â¢ÃƒÂ¢Ã¢â€šÂ¬Ã…Â¡Ãƒâ€šÃ‚Â¬ÃƒÆ’Ã¢â‚¬Â¦Ãƒâ€šÃ‚Â¡ÃƒÆ’Ã†â€™Ãƒâ€ Ã¢â‚¬â„¢ÃƒÆ’Ã‚Â¢ÃƒÂ¢Ã¢â‚¬Å¡Ã‚Â¬Ãƒâ€¦Ã‚Â¡ÃƒÆ’Ã†â€™ÃƒÂ¢Ã¢â€šÂ¬Ã…Â¡ÃƒÆ’Ã¢â‚¬Å¡Ãƒâ€šÃ‚Â¼g</w:t>
       </w:r>
       <w:proofErr w:type="spellEnd"/>
       <w:r>
@@ -8914,7 +8914,7 @@
           <w:sz w:val="28"/>
           <w:szCs w:val="28"/>
         </w:rPr>
-        <w:t>ÃƒÆ’Ã†â€™Ãƒâ€ Ã¢â‚¬â„¢ÃƒÆ’Ã¢â‚¬Â ÃƒÂ¢Ã¢â€šÂ¬Ã¢â€žÂ¢ÃƒÆ’Ã†â€™ÃƒÂ¢Ã¢â€šÂ¬Ã‚Â¦ÃƒÆ’Ã¢â‚¬Å¡Ãƒâ€šÃ‚Â½ÃƒÆ’Ã†â€™Ãƒâ€ Ã¢â‚¬â„¢ÃƒÆ’Ã‚Â¢ÃƒÂ¢Ã¢â‚¬Å¡Ã‚Â¬Ãƒâ€¦Ã‚Â¡ÃƒÆ’Ã†â€™ÃƒÂ¢Ã¢â€šÂ¬Ã…Â¡ÃƒÆ’Ã¢â‚¬Å¡Ãƒâ€šÃ‚Â¼g</w:t>
+        <w:t>ÃƒÆ’Ã†â€™Ãƒâ€ Ã¢â‚¬â„¢ÃƒÆ’Ã¢â‚¬Â ÃƒÂ¢Ã¢â€šÂ¬Ã¢â€žÂ¢ÃƒÆ’Ã†â€™ÃƒÂ¢Ã¢â€šÂ¬Ã‚Â ÃƒÆ’Ã‚Â¢ÃƒÂ¢Ã¢â‚¬Å¡Ã‚Â¬ÃƒÂ¢Ã¢â‚¬Å¾Ã‚Â¢ÃƒÆ’Ã†â€™Ãƒâ€ Ã¢â‚¬â„¢ÃƒÆ’Ã‚Â¢ÃƒÂ¢Ã¢â‚¬Å¡Ã‚Â¬Ãƒâ€šÃ‚Â¦ÃƒÆ’Ã†â€™ÃƒÂ¢Ã¢â€šÂ¬Ã…Â¡ÃƒÆ’Ã¢â‚¬Å¡Ãƒâ€šÃ‚Â½ÃƒÆ’Ã†â€™Ãƒâ€ Ã¢â‚¬â„¢ÃƒÆ’Ã¢â‚¬Â ÃƒÂ¢Ã¢â€šÂ¬Ã¢â€žÂ¢ÃƒÆ’Ã†â€™Ãƒâ€šÃ‚Â¢ÃƒÆ’Ã‚Â¢ÃƒÂ¢Ã¢â€šÂ¬Ã…Â¡Ãƒâ€šÃ‚Â¬ÃƒÆ’Ã¢â‚¬Â¦Ãƒâ€šÃ‚Â¡ÃƒÆ’Ã†â€™Ãƒâ€ Ã¢â‚¬â„¢ÃƒÆ’Ã‚Â¢ÃƒÂ¢Ã¢â‚¬Å¡Ã‚Â¬Ãƒâ€¦Ã‚Â¡ÃƒÆ’Ã†â€™ÃƒÂ¢Ã¢â€šÂ¬Ã…Â¡ÃƒÆ’Ã¢â‚¬Å¡Ãƒâ€šÃ‚Â¼g</w:t>
       </w:r>
       <w:proofErr w:type="spellEnd"/>
       <w:r>
@@ -8932,7 +8932,7 @@
           <w:sz w:val="28"/>
           <w:szCs w:val="28"/>
         </w:rPr>
-        <w:t>ÃƒÆ’Ã†â€™Ãƒâ€ Ã¢â‚¬â„¢ÃƒÆ’Ã¢â‚¬Â ÃƒÂ¢Ã¢â€šÂ¬Ã¢â€žÂ¢ÃƒÆ’Ã†â€™ÃƒÂ¢Ã¢â€šÂ¬Ã‚Â¦ÃƒÆ’Ã¢â‚¬Å¡Ãƒâ€šÃ‚Â½ÃƒÆ’Ã†â€™Ãƒâ€ Ã¢â‚¬â„¢ÃƒÆ’Ã‚Â¢ÃƒÂ¢Ã¢â‚¬Å¡Ã‚Â¬Ãƒâ€¦Ã‚Â¡ÃƒÆ’Ã†â€™ÃƒÂ¢Ã¢â€šÂ¬Ã…Â¡ÃƒÆ’Ã¢â‚¬Å¡Ãƒâ€šÃ‚Â¼g</w:t>
+        <w:t>ÃƒÆ’Ã†â€™Ãƒâ€ Ã¢â‚¬â„¢ÃƒÆ’Ã¢â‚¬Â ÃƒÂ¢Ã¢â€šÂ¬Ã¢â€žÂ¢ÃƒÆ’Ã†â€™ÃƒÂ¢Ã¢â€šÂ¬Ã‚Â ÃƒÆ’Ã‚Â¢ÃƒÂ¢Ã¢â‚¬Å¡Ã‚Â¬ÃƒÂ¢Ã¢â‚¬Å¾Ã‚Â¢ÃƒÆ’Ã†â€™Ãƒâ€ Ã¢â‚¬â„¢ÃƒÆ’Ã‚Â¢ÃƒÂ¢Ã¢â‚¬Å¡Ã‚Â¬Ãƒâ€šÃ‚Â¦ÃƒÆ’Ã†â€™ÃƒÂ¢Ã¢â€šÂ¬Ã…Â¡ÃƒÆ’Ã¢â‚¬Å¡Ãƒâ€šÃ‚Â½ÃƒÆ’Ã†â€™Ãƒâ€ Ã¢â‚¬â„¢ÃƒÆ’Ã¢â‚¬Â ÃƒÂ¢Ã¢â€šÂ¬Ã¢â€žÂ¢ÃƒÆ’Ã†â€™Ãƒâ€šÃ‚Â¢ÃƒÆ’Ã‚Â¢ÃƒÂ¢Ã¢â€šÂ¬Ã…Â¡Ãƒâ€šÃ‚Â¬ÃƒÆ’Ã¢â‚¬Â¦Ãƒâ€šÃ‚Â¡ÃƒÆ’Ã†â€™Ãƒâ€ Ã¢â‚¬â„¢ÃƒÆ’Ã‚Â¢ÃƒÂ¢Ã¢â‚¬Å¡Ã‚Â¬Ãƒâ€¦Ã‚Â¡ÃƒÆ’Ã†â€™ÃƒÂ¢Ã¢â€šÂ¬Ã…Â¡ÃƒÆ’Ã¢â‚¬Å¡Ãƒâ€šÃ‚Â¼g</w:t>
       </w:r>
       <w:proofErr w:type="spellEnd"/>
       <w:r>
@@ -8959,7 +8959,7 @@
           <w:sz w:val="28"/>
           <w:szCs w:val="28"/>
         </w:rPr>
-        <w:t>ÃƒÆ’Ã†â€™Ãƒâ€ Ã¢â‚¬â„¢ÃƒÆ’Ã¢â‚¬Â ÃƒÂ¢Ã¢â€šÂ¬Ã¢â€žÂ¢ÃƒÆ’Ã†â€™ÃƒÂ¢Ã¢â€šÂ¬Ã‚Â¦ÃƒÆ’Ã¢â‚¬Å¡Ãƒâ€šÃ‚Â½ÃƒÆ’Ã†â€™Ãƒâ€ Ã¢â‚¬â„¢ÃƒÆ’Ã‚Â¢ÃƒÂ¢Ã¢â‚¬Å¡Ã‚Â¬Ãƒâ€¦Ã‚Â¡ÃƒÆ’Ã†â€™ÃƒÂ¢Ã¢â€šÂ¬Ã…Â¡ÃƒÆ’Ã¢â‚¬Å¡Ãƒâ€šÃ‚Â¼g</w:t>
+        <w:t>ÃƒÆ’Ã†â€™Ãƒâ€ Ã¢â‚¬â„¢ÃƒÆ’Ã¢â‚¬Â ÃƒÂ¢Ã¢â€šÂ¬Ã¢â€žÂ¢ÃƒÆ’Ã†â€™ÃƒÂ¢Ã¢â€šÂ¬Ã‚Â ÃƒÆ’Ã‚Â¢ÃƒÂ¢Ã¢â‚¬Å¡Ã‚Â¬ÃƒÂ¢Ã¢â‚¬Å¾Ã‚Â¢ÃƒÆ’Ã†â€™Ãƒâ€ Ã¢â‚¬â„¢ÃƒÆ’Ã‚Â¢ÃƒÂ¢Ã¢â‚¬Å¡Ã‚Â¬Ãƒâ€šÃ‚Â¦ÃƒÆ’Ã†â€™ÃƒÂ¢Ã¢â€šÂ¬Ã…Â¡ÃƒÆ’Ã¢â‚¬Å¡Ãƒâ€šÃ‚Â½ÃƒÆ’Ã†â€™Ãƒâ€ Ã¢â‚¬â„¢ÃƒÆ’Ã¢â‚¬Â ÃƒÂ¢Ã¢â€šÂ¬Ã¢â€žÂ¢ÃƒÆ’Ã†â€™Ãƒâ€šÃ‚Â¢ÃƒÆ’Ã‚Â¢ÃƒÂ¢Ã¢â€šÂ¬Ã…Â¡Ãƒâ€šÃ‚Â¬ÃƒÆ’Ã¢â‚¬Â¦Ãƒâ€šÃ‚Â¡ÃƒÆ’Ã†â€™Ãƒâ€ Ã¢â‚¬â„¢ÃƒÆ’Ã‚Â¢ÃƒÂ¢Ã¢â‚¬Å¡Ã‚Â¬Ãƒâ€¦Ã‚Â¡ÃƒÆ’Ã†â€™ÃƒÂ¢Ã¢â€šÂ¬Ã…Â¡ÃƒÆ’Ã¢â‚¬Å¡Ãƒâ€šÃ‚Â¼g</w:t>
       </w:r>
       <w:proofErr w:type="spellEnd"/>
       <w:r>
@@ -8977,7 +8977,7 @@
           <w:sz w:val="28"/>
           <w:szCs w:val="28"/>
         </w:rPr>
-        <w:t>ÃƒÆ’Ã†â€™Ãƒâ€ Ã¢â‚¬â„¢ÃƒÆ’Ã¢â‚¬Â ÃƒÂ¢Ã¢â€šÂ¬Ã¢â€žÂ¢ÃƒÆ’Ã†â€™ÃƒÂ¢Ã¢â€šÂ¬Ã‚Â¦ÃƒÆ’Ã¢â‚¬Å¡Ãƒâ€šÃ‚Â½ÃƒÆ’Ã†â€™Ãƒâ€ Ã¢â‚¬â„¢ÃƒÆ’Ã‚Â¢ÃƒÂ¢Ã¢â‚¬Å¡Ã‚Â¬Ãƒâ€¦Ã‚Â¡ÃƒÆ’Ã†â€™ÃƒÂ¢Ã¢â€šÂ¬Ã…Â¡ÃƒÆ’Ã¢â‚¬Å¡Ãƒâ€šÃ‚Â¼g</w:t>
+        <w:t>ÃƒÆ’Ã†â€™Ãƒâ€ Ã¢â‚¬â„¢ÃƒÆ’Ã¢â‚¬Â ÃƒÂ¢Ã¢â€šÂ¬Ã¢â€žÂ¢ÃƒÆ’Ã†â€™ÃƒÂ¢Ã¢â€šÂ¬Ã‚Â ÃƒÆ’Ã‚Â¢ÃƒÂ¢Ã¢â‚¬Å¡Ã‚Â¬ÃƒÂ¢Ã¢â‚¬Å¾Ã‚Â¢ÃƒÆ’Ã†â€™Ãƒâ€ Ã¢â‚¬â„¢ÃƒÆ’Ã‚Â¢ÃƒÂ¢Ã¢â‚¬Å¡Ã‚Â¬Ãƒâ€šÃ‚Â¦ÃƒÆ’Ã†â€™ÃƒÂ¢Ã¢â€šÂ¬Ã…Â¡ÃƒÆ’Ã¢â‚¬Å¡Ãƒâ€šÃ‚Â½ÃƒÆ’Ã†â€™Ãƒâ€ Ã¢â‚¬â„¢ÃƒÆ’Ã¢â‚¬Â ÃƒÂ¢Ã¢â€šÂ¬Ã¢â€žÂ¢ÃƒÆ’Ã†â€™Ãƒâ€šÃ‚Â¢ÃƒÆ’Ã‚Â¢ÃƒÂ¢Ã¢â€šÂ¬Ã…Â¡Ãƒâ€šÃ‚Â¬ÃƒÆ’Ã¢â‚¬Â¦Ãƒâ€šÃ‚Â¡ÃƒÆ’Ã†â€™Ãƒâ€ Ã¢â‚¬â„¢ÃƒÆ’Ã‚Â¢ÃƒÂ¢Ã¢â‚¬Å¡Ã‚Â¬Ãƒâ€¦Ã‚Â¡ÃƒÆ’Ã†â€™ÃƒÂ¢Ã¢â€šÂ¬Ã…Â¡ÃƒÆ’Ã¢â‚¬Å¡Ãƒâ€šÃ‚Â¼g</w:t>
       </w:r>
       <w:proofErr w:type="spellEnd"/>
       <w:r>
@@ -9134,7 +9134,7 @@
           <w:sz w:val="28"/>
           <w:szCs w:val="28"/>
         </w:rPr>
-        <w:t>ÃƒÆ’Ã†â€™Ãƒâ€ Ã¢â‚¬â„¢ÃƒÆ’Ã¢â‚¬Â ÃƒÂ¢Ã¢â€šÂ¬Ã¢â€žÂ¢ÃƒÆ’Ã†â€™ÃƒÂ¢Ã¢â€šÂ¬Ã‚Â¦ÃƒÆ’Ã¢â‚¬Å¡Ãƒâ€šÃ‚Â½ÃƒÆ’Ã†â€™Ãƒâ€ Ã¢â‚¬â„¢ÃƒÆ’Ã‚Â¢ÃƒÂ¢Ã¢â‚¬Å¡Ã‚Â¬Ãƒâ€¦Ã‚Â¡ÃƒÆ’Ã†â€™ÃƒÂ¢Ã¢â€šÂ¬Ã…Â¡ÃƒÆ’Ã¢â‚¬Å¡Ãƒâ€šÃ‚Â¼g</w:t>
+        <w:t>ÃƒÆ’Ã†â€™Ãƒâ€ Ã¢â‚¬â„¢ÃƒÆ’Ã¢â‚¬Â ÃƒÂ¢Ã¢â€šÂ¬Ã¢â€žÂ¢ÃƒÆ’Ã†â€™ÃƒÂ¢Ã¢â€šÂ¬Ã‚Â ÃƒÆ’Ã‚Â¢ÃƒÂ¢Ã¢â‚¬Å¡Ã‚Â¬ÃƒÂ¢Ã¢â‚¬Å¾Ã‚Â¢ÃƒÆ’Ã†â€™Ãƒâ€ Ã¢â‚¬â„¢ÃƒÆ’Ã‚Â¢ÃƒÂ¢Ã¢â‚¬Å¡Ã‚Â¬Ãƒâ€šÃ‚Â¦ÃƒÆ’Ã†â€™ÃƒÂ¢Ã¢â€šÂ¬Ã…Â¡ÃƒÆ’Ã¢â‚¬Å¡Ãƒâ€šÃ‚Â½ÃƒÆ’Ã†â€™Ãƒâ€ Ã¢â‚¬â„¢ÃƒÆ’Ã¢â‚¬Â ÃƒÂ¢Ã¢â€šÂ¬Ã¢â€žÂ¢ÃƒÆ’Ã†â€™Ãƒâ€šÃ‚Â¢ÃƒÆ’Ã‚Â¢ÃƒÂ¢Ã¢â€šÂ¬Ã…Â¡Ãƒâ€šÃ‚Â¬ÃƒÆ’Ã¢â‚¬Â¦Ãƒâ€šÃ‚Â¡ÃƒÆ’Ã†â€™Ãƒâ€ Ã¢â‚¬â„¢ÃƒÆ’Ã‚Â¢ÃƒÂ¢Ã¢â‚¬Å¡Ã‚Â¬Ãƒâ€¦Ã‚Â¡ÃƒÆ’Ã†â€™ÃƒÂ¢Ã¢â€šÂ¬Ã…Â¡ÃƒÆ’Ã¢â‚¬Å¡Ãƒâ€šÃ‚Â¼g</w:t>
       </w:r>
       <w:proofErr w:type="spellEnd"/>
       <w:r>
@@ -9152,7 +9152,7 @@
           <w:sz w:val="28"/>
           <w:szCs w:val="28"/>
         </w:rPr>
-        <w:t>ÃƒÆ’Ã†â€™Ãƒâ€ Ã¢â‚¬â„¢ÃƒÆ’Ã¢â‚¬Â ÃƒÂ¢Ã¢â€šÂ¬Ã¢â€žÂ¢ÃƒÆ’Ã†â€™ÃƒÂ¢Ã¢â€šÂ¬Ã‚Â¦ÃƒÆ’Ã¢â‚¬Å¡Ãƒâ€šÃ‚Â½ÃƒÆ’Ã†â€™Ãƒâ€ Ã¢â‚¬â„¢ÃƒÆ’Ã‚Â¢ÃƒÂ¢Ã¢â‚¬Å¡Ã‚Â¬Ãƒâ€¦Ã‚Â¡ÃƒÆ’Ã†â€™ÃƒÂ¢Ã¢â€šÂ¬Ã…Â¡ÃƒÆ’Ã¢â‚¬Å¡Ãƒâ€šÃ‚Â¼g</w:t>
+        <w:t>ÃƒÆ’Ã†â€™Ãƒâ€ Ã¢â‚¬â„¢ÃƒÆ’Ã¢â‚¬Â ÃƒÂ¢Ã¢â€šÂ¬Ã¢â€žÂ¢ÃƒÆ’Ã†â€™ÃƒÂ¢Ã¢â€šÂ¬Ã‚Â ÃƒÆ’Ã‚Â¢ÃƒÂ¢Ã¢â‚¬Å¡Ã‚Â¬ÃƒÂ¢Ã¢â‚¬Å¾Ã‚Â¢ÃƒÆ’Ã†â€™Ãƒâ€ Ã¢â‚¬â„¢ÃƒÆ’Ã‚Â¢ÃƒÂ¢Ã¢â‚¬Å¡Ã‚Â¬Ãƒâ€šÃ‚Â¦ÃƒÆ’Ã†â€™ÃƒÂ¢Ã¢â€šÂ¬Ã…Â¡ÃƒÆ’Ã¢â‚¬Å¡Ãƒâ€šÃ‚Â½ÃƒÆ’Ã†â€™Ãƒâ€ Ã¢â‚¬â„¢ÃƒÆ’Ã¢â‚¬Â ÃƒÂ¢Ã¢â€šÂ¬Ã¢â€žÂ¢ÃƒÆ’Ã†â€™Ãƒâ€šÃ‚Â¢ÃƒÆ’Ã‚Â¢ÃƒÂ¢Ã¢â€šÂ¬Ã…Â¡Ãƒâ€šÃ‚Â¬ÃƒÆ’Ã¢â‚¬Â¦Ãƒâ€šÃ‚Â¡ÃƒÆ’Ã†â€™Ãƒâ€ Ã¢â‚¬â„¢ÃƒÆ’Ã‚Â¢ÃƒÂ¢Ã¢â‚¬Å¡Ã‚Â¬Ãƒâ€¦Ã‚Â¡ÃƒÆ’Ã†â€™ÃƒÂ¢Ã¢â€šÂ¬Ã…Â¡ÃƒÆ’Ã¢â‚¬Å¡Ãƒâ€šÃ‚Â¼g</w:t>
       </w:r>
       <w:proofErr w:type="spellEnd"/>
       <w:r>
@@ -9170,7 +9170,7 @@
           <w:sz w:val="28"/>
           <w:szCs w:val="28"/>
         </w:rPr>
-        <w:t>ÃƒÆ’Ã†â€™Ãƒâ€ Ã¢â‚¬â„¢ÃƒÆ’Ã¢â‚¬Â ÃƒÂ¢Ã¢â€šÂ¬Ã¢â€žÂ¢ÃƒÆ’Ã†â€™ÃƒÂ¢Ã¢â€šÂ¬Ã‚Â¦ÃƒÆ’Ã¢â‚¬Å¡Ãƒâ€šÃ‚Â½ÃƒÆ’Ã†â€™Ãƒâ€ Ã¢â‚¬â„¢ÃƒÆ’Ã‚Â¢ÃƒÂ¢Ã¢â‚¬Å¡Ã‚Â¬Ãƒâ€¦Ã‚Â¡ÃƒÆ’Ã†â€™ÃƒÂ¢Ã¢â€šÂ¬Ã…Â¡ÃƒÆ’Ã¢â‚¬Å¡Ãƒâ€šÃ‚Â¼g</w:t>
+        <w:t>ÃƒÆ’Ã†â€™Ãƒâ€ Ã¢â‚¬â„¢ÃƒÆ’Ã¢â‚¬Â ÃƒÂ¢Ã¢â€šÂ¬Ã¢â€žÂ¢ÃƒÆ’Ã†â€™ÃƒÂ¢Ã¢â€šÂ¬Ã‚Â ÃƒÆ’Ã‚Â¢ÃƒÂ¢Ã¢â‚¬Å¡Ã‚Â¬ÃƒÂ¢Ã¢â‚¬Å¾Ã‚Â¢ÃƒÆ’Ã†â€™Ãƒâ€ Ã¢â‚¬â„¢ÃƒÆ’Ã‚Â¢ÃƒÂ¢Ã¢â‚¬Å¡Ã‚Â¬Ãƒâ€šÃ‚Â¦ÃƒÆ’Ã†â€™ÃƒÂ¢Ã¢â€šÂ¬Ã…Â¡ÃƒÆ’Ã¢â‚¬Å¡Ãƒâ€šÃ‚Â½ÃƒÆ’Ã†â€™Ãƒâ€ Ã¢â‚¬â„¢ÃƒÆ’Ã¢â‚¬Â ÃƒÂ¢Ã¢â€šÂ¬Ã¢â€žÂ¢ÃƒÆ’Ã†â€™Ãƒâ€šÃ‚Â¢ÃƒÆ’Ã‚Â¢ÃƒÂ¢Ã¢â€šÂ¬Ã…Â¡Ãƒâ€šÃ‚Â¬ÃƒÆ’Ã¢â‚¬Â¦Ãƒâ€šÃ‚Â¡ÃƒÆ’Ã†â€™Ãƒâ€ Ã¢â‚¬â„¢ÃƒÆ’Ã‚Â¢ÃƒÂ¢Ã¢â‚¬Å¡Ã‚Â¬Ãƒâ€¦Ã‚Â¡ÃƒÆ’Ã†â€™ÃƒÂ¢Ã¢â€šÂ¬Ã…Â¡ÃƒÆ’Ã¢â‚¬Å¡Ãƒâ€šÃ‚Â¼g</w:t>
       </w:r>
       <w:proofErr w:type="spellEnd"/>
       <w:r>
@@ -9188,7 +9188,7 @@
           <w:sz w:val="28"/>
           <w:szCs w:val="28"/>
         </w:rPr>
-        <w:t>ÃƒÆ’Ã†â€™Ãƒâ€ Ã¢â‚¬â„¢ÃƒÆ’Ã¢â‚¬Â ÃƒÂ¢Ã¢â€šÂ¬Ã¢â€žÂ¢ÃƒÆ’Ã†â€™ÃƒÂ¢Ã¢â€šÂ¬Ã‚Â¦ÃƒÆ’Ã¢â‚¬Å¡Ãƒâ€šÃ‚Â½ÃƒÆ’Ã†â€™Ãƒâ€ Ã¢â‚¬â„¢ÃƒÆ’Ã‚Â¢ÃƒÂ¢Ã¢â‚¬Å¡Ã‚Â¬Ãƒâ€¦Ã‚Â¡ÃƒÆ’Ã†â€™ÃƒÂ¢Ã¢â€šÂ¬Ã…Â¡ÃƒÆ’Ã¢â‚¬Å¡Ãƒâ€šÃ‚Â¼g</w:t>
+        <w:t>ÃƒÆ’Ã†â€™Ãƒâ€ Ã¢â‚¬â„¢ÃƒÆ’Ã¢â‚¬Â ÃƒÂ¢Ã¢â€šÂ¬Ã¢â€žÂ¢ÃƒÆ’Ã†â€™ÃƒÂ¢Ã¢â€šÂ¬Ã‚Â ÃƒÆ’Ã‚Â¢ÃƒÂ¢Ã¢â‚¬Å¡Ã‚Â¬ÃƒÂ¢Ã¢â‚¬Å¾Ã‚Â¢ÃƒÆ’Ã†â€™Ãƒâ€ Ã¢â‚¬â„¢ÃƒÆ’Ã‚Â¢ÃƒÂ¢Ã¢â‚¬Å¡Ã‚Â¬Ãƒâ€šÃ‚Â¦ÃƒÆ’Ã†â€™ÃƒÂ¢Ã¢â€šÂ¬Ã…Â¡ÃƒÆ’Ã¢â‚¬Å¡Ãƒâ€šÃ‚Â½ÃƒÆ’Ã†â€™Ãƒâ€ Ã¢â‚¬â„¢ÃƒÆ’Ã¢â‚¬Â ÃƒÂ¢Ã¢â€šÂ¬Ã¢â€žÂ¢ÃƒÆ’Ã†â€™Ãƒâ€šÃ‚Â¢ÃƒÆ’Ã‚Â¢ÃƒÂ¢Ã¢â€šÂ¬Ã…Â¡Ãƒâ€šÃ‚Â¬ÃƒÆ’Ã¢â‚¬Â¦Ãƒâ€šÃ‚Â¡ÃƒÆ’Ã†â€™Ãƒâ€ Ã¢â‚¬â„¢ÃƒÆ’Ã‚Â¢ÃƒÂ¢Ã¢â‚¬Å¡Ã‚Â¬Ãƒâ€¦Ã‚Â¡ÃƒÆ’Ã†â€™ÃƒÂ¢Ã¢â€šÂ¬Ã…Â¡ÃƒÆ’Ã¢â‚¬Å¡Ãƒâ€šÃ‚Â¼g</w:t>
       </w:r>
       <w:proofErr w:type="spellEnd"/>
       <w:r>
@@ -9206,7 +9206,7 @@
           <w:sz w:val="28"/>
           <w:szCs w:val="28"/>
         </w:rPr>
-        <w:t>ÃƒÆ’Ã†â€™Ãƒâ€ Ã¢â‚¬â„¢ÃƒÆ’Ã¢â‚¬Â ÃƒÂ¢Ã¢â€šÂ¬Ã¢â€žÂ¢ÃƒÆ’Ã†â€™ÃƒÂ¢Ã¢â€šÂ¬Ã‚Â¦ÃƒÆ’Ã¢â‚¬Å¡Ãƒâ€šÃ‚Â½ÃƒÆ’Ã†â€™Ãƒâ€ Ã¢â‚¬â„¢ÃƒÆ’Ã‚Â¢ÃƒÂ¢Ã¢â‚¬Å¡Ã‚Â¬Ãƒâ€¦Ã‚Â¡ÃƒÆ’Ã†â€™ÃƒÂ¢Ã¢â€šÂ¬Ã…Â¡ÃƒÆ’Ã¢â‚¬Å¡Ãƒâ€šÃ‚Â¼g</w:t>
+        <w:t>ÃƒÆ’Ã†â€™Ãƒâ€ Ã¢â‚¬â„¢ÃƒÆ’Ã¢â‚¬Â ÃƒÂ¢Ã¢â€šÂ¬Ã¢â€žÂ¢ÃƒÆ’Ã†â€™ÃƒÂ¢Ã¢â€šÂ¬Ã‚Â ÃƒÆ’Ã‚Â¢ÃƒÂ¢Ã¢â‚¬Å¡Ã‚Â¬ÃƒÂ¢Ã¢â‚¬Å¾Ã‚Â¢ÃƒÆ’Ã†â€™Ãƒâ€ Ã¢â‚¬â„¢ÃƒÆ’Ã‚Â¢ÃƒÂ¢Ã¢â‚¬Å¡Ã‚Â¬Ãƒâ€šÃ‚Â¦ÃƒÆ’Ã†â€™ÃƒÂ¢Ã¢â€šÂ¬Ã…Â¡ÃƒÆ’Ã¢â‚¬Å¡Ãƒâ€šÃ‚Â½ÃƒÆ’Ã†â€™Ãƒâ€ Ã¢â‚¬â„¢ÃƒÆ’Ã¢â‚¬Â ÃƒÂ¢Ã¢â€šÂ¬Ã¢â€žÂ¢ÃƒÆ’Ã†â€™Ãƒâ€šÃ‚Â¢ÃƒÆ’Ã‚Â¢ÃƒÂ¢Ã¢â€šÂ¬Ã…Â¡Ãƒâ€šÃ‚Â¬ÃƒÆ’Ã¢â‚¬Â¦Ãƒâ€šÃ‚Â¡ÃƒÆ’Ã†â€™Ãƒâ€ Ã¢â‚¬â„¢ÃƒÆ’Ã‚Â¢ÃƒÂ¢Ã¢â‚¬Å¡Ã‚Â¬Ãƒâ€¦Ã‚Â¡ÃƒÆ’Ã†â€™ÃƒÂ¢Ã¢â€šÂ¬Ã…Â¡ÃƒÆ’Ã¢â‚¬Å¡Ãƒâ€šÃ‚Â¼g</w:t>
       </w:r>
       <w:proofErr w:type="spellEnd"/>
       <w:r>

</xml_diff>

<commit_message>
Generate scientific study area map
</commit_message>
<xml_diff>
--- a/result.docx
+++ b/result.docx
@@ -1694,7 +1694,7 @@
           <w:b/>
           <w:bCs/>
         </w:rPr>
-        <w:t xml:space="preserve">Table 2: Descriptive Statistics and WelchÃƒÆ’Ã†â€™Ãƒâ€ Ã¢â‚¬â„¢ÃƒÆ’Ã¢â‚¬Â ÃƒÂ¢Ã¢â€šÂ¬Ã¢â€žÂ¢ÃƒÆ’Ã†â€™ÃƒÂ¢Ã¢â€šÂ¬Ã‚Â ÃƒÆ’Ã‚Â¢ÃƒÂ¢Ã¢â‚¬Å¡Ã‚Â¬ÃƒÂ¢Ã¢â‚¬Å¾Ã‚Â¢ÃƒÆ’Ã†â€™Ãƒâ€ Ã¢â‚¬â„¢ÃƒÆ’Ã‚Â¢ÃƒÂ¢Ã¢â‚¬Å¡Ã‚Â¬Ãƒâ€¦Ã‚Â¡ÃƒÆ’Ã†â€™ÃƒÂ¢Ã¢â€šÂ¬Ã…Â¡ÃƒÆ’Ã¢â‚¬Å¡Ãƒâ€šÃ‚Â¢ÃƒÆ’Ã†â€™Ãƒâ€ Ã¢â‚¬â„¢ÃƒÆ’Ã¢â‚¬Â ÃƒÂ¢Ã¢â€šÂ¬Ã¢â€žÂ¢ÃƒÆ’Ã†â€™ÃƒÂ¢Ã¢â€šÂ¬Ã…Â¡ÃƒÆ’Ã¢â‚¬Å¡Ãƒâ€šÃ‚Â¢ÃƒÆ’Ã†â€™Ãƒâ€ Ã¢â‚¬â„¢ÃƒÆ’Ã¢â‚¬Å¡Ãƒâ€šÃ‚Â¢ÃƒÆ’Ã†â€™Ãƒâ€šÃ‚Â¢ÃƒÆ’Ã‚Â¢ÃƒÂ¢Ã¢â‚¬Å¡Ã‚Â¬Ãƒâ€¦Ã‚Â¡ÃƒÆ’Ã¢â‚¬Å¡Ãƒâ€šÃ‚Â¬ÃƒÆ’Ã†â€™ÃƒÂ¢Ã¢â€šÂ¬Ã‚Â¦ÃƒÆ’Ã¢â‚¬Å¡Ãƒâ€šÃ‚Â¡ÃƒÆ’Ã†â€™Ãƒâ€ Ã¢â‚¬â„¢ÃƒÆ’Ã‚Â¢ÃƒÂ¢Ã¢â‚¬Å¡Ã‚Â¬Ãƒâ€¦Ã‚Â¡ÃƒÆ’Ã†â€™ÃƒÂ¢Ã¢â€šÂ¬Ã…Â¡ÃƒÆ’Ã¢â‚¬Å¡Ãƒâ€šÃ‚Â¬ÃƒÆ’Ã†â€™Ãƒâ€ Ã¢â‚¬â„¢ÃƒÆ’Ã¢â‚¬Â ÃƒÂ¢Ã¢â€šÂ¬Ã¢â€žÂ¢ÃƒÆ’Ã†â€™ÃƒÂ¢Ã¢â€šÂ¬Ã…Â¡ÃƒÆ’Ã¢â‚¬Å¡Ãƒâ€šÃ‚Â¢ÃƒÆ’Ã†â€™Ãƒâ€ Ã¢â‚¬â„¢ÃƒÆ’Ã¢â‚¬Å¡Ãƒâ€šÃ‚Â¢ÃƒÆ’Ã†â€™Ãƒâ€šÃ‚Â¢ÃƒÆ’Ã‚Â¢ÃƒÂ¢Ã¢â‚¬Å¡Ã‚Â¬Ãƒâ€¦Ã‚Â¡ÃƒÆ’Ã¢â‚¬Å¡Ãƒâ€šÃ‚Â¬ÃƒÆ’Ã†â€™ÃƒÂ¢Ã¢â€šÂ¬Ã‚Â¦ÃƒÆ’Ã¢â‚¬Å¡Ãƒâ€šÃ‚Â¾ÃƒÆ’Ã†â€™Ãƒâ€ Ã¢â‚¬â„¢ÃƒÆ’Ã‚Â¢ÃƒÂ¢Ã¢â‚¬Å¡Ã‚Â¬Ãƒâ€¦Ã‚Â¡ÃƒÆ’Ã†â€™ÃƒÂ¢Ã¢â€šÂ¬Ã…Â¡ÃƒÆ’Ã¢â‚¬Å¡Ãƒâ€šÃ‚Â¢s t-test Results for </w:t>
+        <w:t xml:space="preserve">Table 2: Descriptive Statistics and WelchÃƒÆ’Ã†â€™Ãƒâ€ Ã¢â‚¬â„¢ÃƒÆ’Ã¢â‚¬Â ÃƒÂ¢Ã¢â€šÂ¬Ã¢â€žÂ¢ÃƒÆ’Ã†â€™ÃƒÂ¢Ã¢â€šÂ¬Ã‚Â ÃƒÆ’Ã‚Â¢ÃƒÂ¢Ã¢â‚¬Å¡Ã‚Â¬ÃƒÂ¢Ã¢â‚¬Å¾Ã‚Â¢ÃƒÆ’Ã†â€™Ãƒâ€ Ã¢â‚¬â„¢ÃƒÆ’Ã‚Â¢ÃƒÂ¢Ã¢â‚¬Å¡Ã‚Â¬Ãƒâ€šÃ‚Â ÃƒÆ’Ã†â€™Ãƒâ€šÃ‚Â¢ÃƒÆ’Ã‚Â¢ÃƒÂ¢Ã¢â€šÂ¬Ã…Â¡Ãƒâ€šÃ‚Â¬ÃƒÆ’Ã‚Â¢ÃƒÂ¢Ã¢â€šÂ¬Ã…Â¾Ãƒâ€šÃ‚Â¢ÃƒÆ’Ã†â€™Ãƒâ€ Ã¢â‚¬â„¢ÃƒÆ’Ã¢â‚¬Â ÃƒÂ¢Ã¢â€šÂ¬Ã¢â€žÂ¢ÃƒÆ’Ã†â€™Ãƒâ€šÃ‚Â¢ÃƒÆ’Ã‚Â¢ÃƒÂ¢Ã¢â€šÂ¬Ã…Â¡Ãƒâ€šÃ‚Â¬ÃƒÆ’Ã¢â‚¬Å¡Ãƒâ€šÃ‚Â ÃƒÆ’Ã†â€™Ãƒâ€ Ã¢â‚¬â„¢ÃƒÆ’Ã¢â‚¬Å¡Ãƒâ€šÃ‚Â¢ÃƒÆ’Ã†â€™Ãƒâ€šÃ‚Â¢ÃƒÆ’Ã‚Â¢ÃƒÂ¢Ã¢â‚¬Å¡Ã‚Â¬Ãƒâ€¦Ã‚Â¡ÃƒÆ’Ã¢â‚¬Å¡Ãƒâ€šÃ‚Â¬ÃƒÆ’Ã†â€™Ãƒâ€šÃ‚Â¢ÃƒÆ’Ã‚Â¢ÃƒÂ¢Ã¢â‚¬Å¡Ã‚Â¬Ãƒâ€¦Ã‚Â¾ÃƒÆ’Ã¢â‚¬Å¡Ãƒâ€šÃ‚Â¢ÃƒÆ’Ã†â€™Ãƒâ€ Ã¢â‚¬â„¢ÃƒÆ’Ã¢â‚¬Â ÃƒÂ¢Ã¢â€šÂ¬Ã¢â€žÂ¢ÃƒÆ’Ã†â€™ÃƒÂ¢Ã¢â€šÂ¬Ã‚Â ÃƒÆ’Ã‚Â¢ÃƒÂ¢Ã¢â‚¬Å¡Ã‚Â¬ÃƒÂ¢Ã¢â‚¬Å¾Ã‚Â¢ÃƒÆ’Ã†â€™Ãƒâ€ Ã¢â‚¬â„¢ÃƒÆ’Ã¢â‚¬Å¡Ãƒâ€šÃ‚Â¢ÃƒÆ’Ã†â€™Ãƒâ€šÃ‚Â¢ÃƒÆ’Ã‚Â¢ÃƒÂ¢Ã¢â‚¬Å¡Ã‚Â¬Ãƒâ€¦Ã‚Â¡ÃƒÆ’Ã¢â‚¬Å¡Ãƒâ€šÃ‚Â¬ÃƒÆ’Ã†â€™ÃƒÂ¢Ã¢â€šÂ¬Ã‚Â¦ÃƒÆ’Ã¢â‚¬Å¡Ãƒâ€šÃ‚Â¡ÃƒÆ’Ã†â€™Ãƒâ€ Ã¢â‚¬â„¢ÃƒÆ’Ã¢â‚¬Â ÃƒÂ¢Ã¢â€šÂ¬Ã¢â€žÂ¢ÃƒÆ’Ã†â€™Ãƒâ€šÃ‚Â¢ÃƒÆ’Ã‚Â¢ÃƒÂ¢Ã¢â€šÂ¬Ã…Â¡Ãƒâ€šÃ‚Â¬ÃƒÆ’Ã¢â‚¬Â¦Ãƒâ€šÃ‚Â¡ÃƒÆ’Ã†â€™Ãƒâ€ Ã¢â‚¬â„¢ÃƒÆ’Ã‚Â¢ÃƒÂ¢Ã¢â‚¬Å¡Ã‚Â¬Ãƒâ€¦Ã‚Â¡ÃƒÆ’Ã†â€™ÃƒÂ¢Ã¢â€šÂ¬Ã…Â¡ÃƒÆ’Ã¢â‚¬Å¡Ãƒâ€šÃ‚Â¢ÃƒÆ’Ã†â€™Ãƒâ€ Ã¢â‚¬â„¢ÃƒÆ’Ã¢â‚¬Â ÃƒÂ¢Ã¢â€šÂ¬Ã¢â€žÂ¢ÃƒÆ’Ã†â€™ÃƒÂ¢Ã¢â€šÂ¬Ã‚Â ÃƒÆ’Ã‚Â¢ÃƒÂ¢Ã¢â‚¬Å¡Ã‚Â¬ÃƒÂ¢Ã¢â‚¬Å¾Ã‚Â¢ÃƒÆ’Ã†â€™Ãƒâ€ Ã¢â‚¬â„¢ÃƒÆ’Ã‚Â¢ÃƒÂ¢Ã¢â‚¬Å¡Ã‚Â¬Ãƒâ€šÃ‚Â ÃƒÆ’Ã†â€™Ãƒâ€šÃ‚Â¢ÃƒÆ’Ã‚Â¢ÃƒÂ¢Ã¢â€šÂ¬Ã…Â¡Ãƒâ€šÃ‚Â¬ÃƒÆ’Ã‚Â¢ÃƒÂ¢Ã¢â€šÂ¬Ã…Â¾Ãƒâ€šÃ‚Â¢ÃƒÆ’Ã†â€™Ãƒâ€ Ã¢â‚¬â„¢ÃƒÆ’Ã¢â‚¬Â ÃƒÂ¢Ã¢â€šÂ¬Ã¢â€žÂ¢ÃƒÆ’Ã†â€™Ãƒâ€šÃ‚Â¢ÃƒÆ’Ã‚Â¢ÃƒÂ¢Ã¢â€šÂ¬Ã…Â¡Ãƒâ€šÃ‚Â¬ÃƒÆ’Ã¢â‚¬Â¦Ãƒâ€šÃ‚Â¡ÃƒÆ’Ã†â€™Ãƒâ€ Ã¢â‚¬â„¢ÃƒÆ’Ã‚Â¢ÃƒÂ¢Ã¢â‚¬Å¡Ã‚Â¬Ãƒâ€¦Ã‚Â¡ÃƒÆ’Ã†â€™ÃƒÂ¢Ã¢â€šÂ¬Ã…Â¡ÃƒÆ’Ã¢â‚¬Å¡Ãƒâ€šÃ‚Â¢ÃƒÆ’Ã†â€™Ãƒâ€ Ã¢â‚¬â„¢ÃƒÆ’Ã¢â‚¬Â ÃƒÂ¢Ã¢â€šÂ¬Ã¢â€žÂ¢ÃƒÆ’Ã†â€™ÃƒÂ¢Ã¢â€šÂ¬Ã‚Â ÃƒÆ’Ã‚Â¢ÃƒÂ¢Ã¢â‚¬Å¡Ã‚Â¬ÃƒÂ¢Ã¢â‚¬Å¾Ã‚Â¢ÃƒÆ’Ã†â€™Ãƒâ€ Ã¢â‚¬â„¢ÃƒÆ’Ã‚Â¢ÃƒÂ¢Ã¢â‚¬Å¡Ã‚Â¬Ãƒâ€¦Ã‚Â¡ÃƒÆ’Ã†â€™ÃƒÂ¢Ã¢â€šÂ¬Ã…Â¡ÃƒÆ’Ã¢â‚¬Å¡Ãƒâ€šÃ‚Â¢ÃƒÆ’Ã†â€™Ãƒâ€ Ã¢â‚¬â„¢ÃƒÆ’Ã¢â‚¬Â ÃƒÂ¢Ã¢â€šÂ¬Ã¢â€žÂ¢ÃƒÆ’Ã†â€™ÃƒÂ¢Ã¢â€šÂ¬Ã…Â¡ÃƒÆ’Ã¢â‚¬Å¡Ãƒâ€šÃ‚Â¢ÃƒÆ’Ã†â€™Ãƒâ€ Ã¢â‚¬â„¢ÃƒÆ’Ã¢â‚¬Å¡Ãƒâ€šÃ‚Â¢ÃƒÆ’Ã†â€™Ãƒâ€šÃ‚Â¢ÃƒÆ’Ã‚Â¢ÃƒÂ¢Ã¢â‚¬Å¡Ã‚Â¬Ãƒâ€¦Ã‚Â¡ÃƒÆ’Ã¢â‚¬Å¡Ãƒâ€šÃ‚Â¬ÃƒÆ’Ã†â€™ÃƒÂ¢Ã¢â€šÂ¬Ã‚Â¦ÃƒÆ’Ã¢â‚¬Å¡Ãƒâ€šÃ‚Â¡ÃƒÆ’Ã†â€™Ãƒâ€ Ã¢â‚¬â„¢ÃƒÆ’Ã‚Â¢ÃƒÂ¢Ã¢â‚¬Å¡Ã‚Â¬Ãƒâ€¦Ã‚Â¡ÃƒÆ’Ã†â€™ÃƒÂ¢Ã¢â€šÂ¬Ã…Â¡ÃƒÆ’Ã¢â‚¬Å¡Ãƒâ€šÃ‚Â¬ÃƒÆ’Ã†â€™Ãƒâ€ Ã¢â‚¬â„¢ÃƒÆ’Ã¢â‚¬Â ÃƒÂ¢Ã¢â€šÂ¬Ã¢â€žÂ¢ÃƒÆ’Ã†â€™Ãƒâ€šÃ‚Â¢ÃƒÆ’Ã‚Â¢ÃƒÂ¢Ã¢â€šÂ¬Ã…Â¡Ãƒâ€šÃ‚Â¬ÃƒÆ’Ã¢â‚¬Å¡Ãƒâ€šÃ‚Â¦ÃƒÆ’Ã†â€™Ãƒâ€ Ã¢â‚¬â„¢ÃƒÆ’Ã‚Â¢ÃƒÂ¢Ã¢â‚¬Å¡Ã‚Â¬Ãƒâ€¦Ã‚Â¡ÃƒÆ’Ã†â€™ÃƒÂ¢Ã¢â€šÂ¬Ã…Â¡ÃƒÆ’Ã¢â‚¬Å¡Ãƒâ€šÃ‚Â¡ÃƒÆ’Ã†â€™Ãƒâ€ Ã¢â‚¬â„¢ÃƒÆ’Ã¢â‚¬Â ÃƒÂ¢Ã¢â€šÂ¬Ã¢â€žÂ¢ÃƒÆ’Ã†â€™ÃƒÂ¢Ã¢â€šÂ¬Ã‚Â ÃƒÆ’Ã‚Â¢ÃƒÂ¢Ã¢â‚¬Å¡Ã‚Â¬ÃƒÂ¢Ã¢â‚¬Å¾Ã‚Â¢ÃƒÆ’Ã†â€™Ãƒâ€ Ã¢â‚¬â„¢ÃƒÆ’Ã¢â‚¬Å¡Ãƒâ€šÃ‚Â¢ÃƒÆ’Ã†â€™Ãƒâ€šÃ‚Â¢ÃƒÆ’Ã‚Â¢ÃƒÂ¢Ã¢â‚¬Å¡Ã‚Â¬Ãƒâ€¦Ã‚Â¡ÃƒÆ’Ã¢â‚¬Å¡Ãƒâ€šÃ‚Â¬ÃƒÆ’Ã†â€™ÃƒÂ¢Ã¢â€šÂ¬Ã‚Â¦ÃƒÆ’Ã¢â‚¬Å¡Ãƒâ€šÃ‚Â¡ÃƒÆ’Ã†â€™Ãƒâ€ Ã¢â‚¬â„¢ÃƒÆ’Ã¢â‚¬Â ÃƒÂ¢Ã¢â€šÂ¬Ã¢â€žÂ¢ÃƒÆ’Ã†â€™Ãƒâ€šÃ‚Â¢ÃƒÆ’Ã‚Â¢ÃƒÂ¢Ã¢â€šÂ¬Ã…Â¡Ãƒâ€šÃ‚Â¬ÃƒÆ’Ã¢â‚¬Â¦Ãƒâ€šÃ‚Â¡ÃƒÆ’Ã†â€™Ãƒâ€ Ã¢â‚¬â„¢ÃƒÆ’Ã‚Â¢ÃƒÂ¢Ã¢â‚¬Å¡Ã‚Â¬Ãƒâ€¦Ã‚Â¡ÃƒÆ’Ã†â€™ÃƒÂ¢Ã¢â€šÂ¬Ã…Â¡ÃƒÆ’Ã¢â‚¬Å¡Ãƒâ€šÃ‚Â¬ÃƒÆ’Ã†â€™Ãƒâ€ Ã¢â‚¬â„¢ÃƒÆ’Ã¢â‚¬Â ÃƒÂ¢Ã¢â€šÂ¬Ã¢â€žÂ¢ÃƒÆ’Ã†â€™ÃƒÂ¢Ã¢â€šÂ¬Ã‚Â ÃƒÆ’Ã‚Â¢ÃƒÂ¢Ã¢â‚¬Å¡Ã‚Â¬ÃƒÂ¢Ã¢â‚¬Å¾Ã‚Â¢ÃƒÆ’Ã†â€™Ãƒâ€ Ã¢â‚¬â„¢ÃƒÆ’Ã‚Â¢ÃƒÂ¢Ã¢â‚¬Å¡Ã‚Â¬Ãƒâ€šÃ‚Â ÃƒÆ’Ã†â€™Ãƒâ€šÃ‚Â¢ÃƒÆ’Ã‚Â¢ÃƒÂ¢Ã¢â€šÂ¬Ã…Â¡Ãƒâ€šÃ‚Â¬ÃƒÆ’Ã‚Â¢ÃƒÂ¢Ã¢â€šÂ¬Ã…Â¾Ãƒâ€šÃ‚Â¢ÃƒÆ’Ã†â€™Ãƒâ€ Ã¢â‚¬â„¢ÃƒÆ’Ã¢â‚¬Â ÃƒÂ¢Ã¢â€šÂ¬Ã¢â€žÂ¢ÃƒÆ’Ã†â€™Ãƒâ€šÃ‚Â¢ÃƒÆ’Ã‚Â¢ÃƒÂ¢Ã¢â€šÂ¬Ã…Â¡Ãƒâ€šÃ‚Â¬ÃƒÆ’Ã¢â‚¬Â¦Ãƒâ€šÃ‚Â¡ÃƒÆ’Ã†â€™Ãƒâ€ Ã¢â‚¬â„¢ÃƒÆ’Ã‚Â¢ÃƒÂ¢Ã¢â‚¬Å¡Ã‚Â¬Ãƒâ€¦Ã‚Â¡ÃƒÆ’Ã†â€™ÃƒÂ¢Ã¢â€šÂ¬Ã…Â¡ÃƒÆ’Ã¢â‚¬Å¡Ãƒâ€šÃ‚Â¢ÃƒÆ’Ã†â€™Ãƒâ€ Ã¢â‚¬â„¢ÃƒÆ’Ã¢â‚¬Â ÃƒÂ¢Ã¢â€šÂ¬Ã¢â€žÂ¢ÃƒÆ’Ã†â€™ÃƒÂ¢Ã¢â€šÂ¬Ã‚Â ÃƒÆ’Ã‚Â¢ÃƒÂ¢Ã¢â‚¬Å¡Ã‚Â¬ÃƒÂ¢Ã¢â‚¬Å¾Ã‚Â¢ÃƒÆ’Ã†â€™Ãƒâ€ Ã¢â‚¬â„¢ÃƒÆ’Ã‚Â¢ÃƒÂ¢Ã¢â‚¬Å¡Ã‚Â¬Ãƒâ€¦Ã‚Â¡ÃƒÆ’Ã†â€™ÃƒÂ¢Ã¢â€šÂ¬Ã…Â¡ÃƒÆ’Ã¢â‚¬Å¡Ãƒâ€šÃ‚Â¢ÃƒÆ’Ã†â€™Ãƒâ€ Ã¢â‚¬â„¢ÃƒÆ’Ã¢â‚¬Â ÃƒÂ¢Ã¢â€šÂ¬Ã¢â€žÂ¢ÃƒÆ’Ã†â€™ÃƒÂ¢Ã¢â€šÂ¬Ã…Â¡ÃƒÆ’Ã¢â‚¬Å¡Ãƒâ€šÃ‚Â¢ÃƒÆ’Ã†â€™Ãƒâ€ Ã¢â‚¬â„¢ÃƒÆ’Ã¢â‚¬Å¡Ãƒâ€šÃ‚Â¢ÃƒÆ’Ã†â€™Ãƒâ€šÃ‚Â¢ÃƒÆ’Ã‚Â¢ÃƒÂ¢Ã¢â‚¬Å¡Ã‚Â¬Ãƒâ€¦Ã‚Â¡ÃƒÆ’Ã¢â‚¬Å¡Ãƒâ€šÃ‚Â¬ÃƒÆ’Ã†â€™ÃƒÂ¢Ã¢â€šÂ¬Ã‚Â¦ÃƒÆ’Ã¢â‚¬Å¡Ãƒâ€šÃ‚Â¡ÃƒÆ’Ã†â€™Ãƒâ€ Ã¢â‚¬â„¢ÃƒÆ’Ã‚Â¢ÃƒÂ¢Ã¢â‚¬Å¡Ã‚Â¬Ãƒâ€¦Ã‚Â¡ÃƒÆ’Ã†â€™ÃƒÂ¢Ã¢â€šÂ¬Ã…Â¡ÃƒÆ’Ã¢â‚¬Å¡Ãƒâ€šÃ‚Â¬ÃƒÆ’Ã†â€™Ãƒâ€ Ã¢â‚¬â„¢ÃƒÆ’Ã¢â‚¬Â ÃƒÂ¢Ã¢â€šÂ¬Ã¢â€žÂ¢ÃƒÆ’Ã†â€™Ãƒâ€šÃ‚Â¢ÃƒÆ’Ã‚Â¢ÃƒÂ¢Ã¢â€šÂ¬Ã…Â¡Ãƒâ€šÃ‚Â¬ÃƒÆ’Ã¢â‚¬Å¡Ãƒâ€šÃ‚Â¦ÃƒÆ’Ã†â€™Ãƒâ€ Ã¢â‚¬â„¢ÃƒÆ’Ã‚Â¢ÃƒÂ¢Ã¢â‚¬Å¡Ã‚Â¬Ãƒâ€¦Ã‚Â¡ÃƒÆ’Ã†â€™ÃƒÂ¢Ã¢â€šÂ¬Ã…Â¡ÃƒÆ’Ã¢â‚¬Å¡Ãƒâ€šÃ‚Â¾ÃƒÆ’Ã†â€™Ãƒâ€ Ã¢â‚¬â„¢ÃƒÆ’Ã¢â‚¬Â ÃƒÂ¢Ã¢â€šÂ¬Ã¢â€žÂ¢ÃƒÆ’Ã†â€™ÃƒÂ¢Ã¢â€šÂ¬Ã‚Â ÃƒÆ’Ã‚Â¢ÃƒÂ¢Ã¢â‚¬Å¡Ã‚Â¬ÃƒÂ¢Ã¢â‚¬Å¾Ã‚Â¢ÃƒÆ’Ã†â€™Ãƒâ€ Ã¢â‚¬â„¢ÃƒÆ’Ã¢â‚¬Å¡Ãƒâ€šÃ‚Â¢ÃƒÆ’Ã†â€™Ãƒâ€šÃ‚Â¢ÃƒÆ’Ã‚Â¢ÃƒÂ¢Ã¢â‚¬Å¡Ã‚Â¬Ãƒâ€¦Ã‚Â¡ÃƒÆ’Ã¢â‚¬Å¡Ãƒâ€šÃ‚Â¬ÃƒÆ’Ã†â€™ÃƒÂ¢Ã¢â€šÂ¬Ã‚Â¦ÃƒÆ’Ã¢â‚¬Å¡Ãƒâ€šÃ‚Â¡ÃƒÆ’Ã†â€™Ãƒâ€ Ã¢â‚¬â„¢ÃƒÆ’Ã¢â‚¬Â ÃƒÂ¢Ã¢â€šÂ¬Ã¢â€žÂ¢ÃƒÆ’Ã†â€™Ãƒâ€šÃ‚Â¢ÃƒÆ’Ã‚Â¢ÃƒÂ¢Ã¢â€šÂ¬Ã…Â¡Ãƒâ€šÃ‚Â¬ÃƒÆ’Ã¢â‚¬Â¦Ãƒâ€šÃ‚Â¡ÃƒÆ’Ã†â€™Ãƒâ€ Ã¢â‚¬â„¢ÃƒÆ’Ã‚Â¢ÃƒÂ¢Ã¢â‚¬Å¡Ã‚Â¬Ãƒâ€¦Ã‚Â¡ÃƒÆ’Ã†â€™ÃƒÂ¢Ã¢â€šÂ¬Ã…Â¡ÃƒÆ’Ã¢â‚¬Å¡Ãƒâ€šÃ‚Â¢s t-test Results for </w:t>
       </w:r>
       <w:r>
         <w:rPr>
@@ -2351,21 +2351,21 @@
         <w:rPr>
           <w:rFonts w:ascii="Times New Roman" w:hAnsi="Times New Roman" w:cs="Times New Roman"/>
         </w:rPr>
-        <w:t xml:space="preserve"> in IMTA and Monoculture systems across four sampling intervals. Overall, both systems show fluctuating growth patterns, including periods of weight loss and recovery. In the early phase (Wk2ÃƒÆ’Ã†â€™Ãƒâ€ Ã¢â‚¬â„¢ÃƒÆ’Ã¢â‚¬Â ÃƒÂ¢Ã¢â€šÂ¬Ã¢â€žÂ¢ÃƒÆ’Ã†â€™ÃƒÂ¢Ã¢â€šÂ¬Ã‚Â ÃƒÆ’Ã‚Â¢ÃƒÂ¢Ã¢â‚¬Å¡Ã‚Â¬ÃƒÂ¢Ã¢â‚¬Å¾Ã‚Â¢ÃƒÆ’Ã†â€™Ãƒâ€ Ã¢â‚¬â„¢ÃƒÆ’Ã‚Â¢ÃƒÂ¢Ã¢â‚¬Å¡Ã‚Â¬Ãƒâ€¦Ã‚Â¡ÃƒÆ’Ã†â€™ÃƒÂ¢Ã¢â€šÂ¬Ã…Â¡ÃƒÆ’Ã¢â‚¬Å¡Ãƒâ€šÃ‚Â¢ÃƒÆ’Ã†â€™Ãƒâ€ Ã¢â‚¬â„¢ÃƒÆ’Ã¢â‚¬Â ÃƒÂ¢Ã¢â€šÂ¬Ã¢â€žÂ¢ÃƒÆ’Ã†â€™ÃƒÂ¢Ã¢â€šÂ¬Ã…Â¡ÃƒÆ’Ã¢â‚¬Å¡Ãƒâ€šÃ‚Â¢ÃƒÆ’Ã†â€™Ãƒâ€ Ã¢â‚¬â„¢ÃƒÆ’Ã¢â‚¬Å¡Ãƒâ€šÃ‚Â¢ÃƒÆ’Ã†â€™Ãƒâ€šÃ‚Â¢ÃƒÆ’Ã‚Â¢ÃƒÂ¢Ã¢â‚¬Å¡Ã‚Â¬Ãƒâ€¦Ã‚Â¡ÃƒÆ’Ã¢â‚¬Å¡Ãƒâ€šÃ‚Â¬ÃƒÆ’Ã†â€™ÃƒÂ¢Ã¢â€šÂ¬Ã‚Â¦ÃƒÆ’Ã¢â‚¬Å¡Ãƒâ€šÃ‚Â¡ÃƒÆ’Ã†â€™Ãƒâ€ Ã¢â‚¬â„¢ÃƒÆ’Ã‚Â¢ÃƒÂ¢Ã¢â‚¬Å¡Ã‚Â¬Ãƒâ€¦Ã‚Â¡ÃƒÆ’Ã†â€™ÃƒÂ¢Ã¢â€šÂ¬Ã…Â¡ÃƒÆ’Ã¢â‚¬Å¡Ãƒâ€šÃ‚Â¬ÃƒÆ’Ã†â€™Ãƒâ€ Ã¢â‚¬â„¢ÃƒÆ’Ã¢â‚¬Â ÃƒÂ¢Ã¢â€šÂ¬Ã¢â€žÂ¢ÃƒÆ’Ã†â€™ÃƒÂ¢Ã¢â€šÂ¬Ã…Â¡ÃƒÆ’Ã¢â‚¬Å¡Ãƒâ€šÃ‚Â¢ÃƒÆ’Ã†â€™Ãƒâ€ Ã¢â‚¬â„¢ÃƒÆ’Ã¢â‚¬Å¡Ãƒâ€šÃ‚Â¢ÃƒÆ’Ã†â€™Ãƒâ€šÃ‚Â¢ÃƒÆ’Ã‚Â¢ÃƒÂ¢Ã¢â€šÂ¬Ã…Â¡Ãƒâ€šÃ‚Â¬ÃƒÆ’Ã¢â‚¬Â¦Ãƒâ€šÃ‚Â¡ÃƒÆ’Ã†â€™ÃƒÂ¢Ã¢â€šÂ¬Ã…Â¡ÃƒÆ’Ã¢â‚¬Å¡Ãƒâ€šÃ‚Â¬ÃƒÆ’Ã†â€™Ãƒâ€ Ã¢â‚¬â„¢ÃƒÆ’Ã‚Â¢ÃƒÂ¢Ã¢â‚¬Å¡Ã‚Â¬Ãƒâ€šÃ‚Â¦ÃƒÆ’Ã†â€™Ãƒâ€šÃ‚Â¢ÃƒÆ’Ã‚Â¢ÃƒÂ¢Ã¢â€šÂ¬Ã…Â¡Ãƒâ€šÃ‚Â¬ÃƒÆ’Ã¢â‚¬Â¦ÃƒÂ¢Ã¢â€šÂ¬Ã…â€œWk3), both treatments recorded negative growth rates, with the IMTA system showing a sharper decline (-5.953 g/day) compared to the Monoculture (-2.916 g/day). During the recovery phase (Wk3ÃƒÆ’Ã†â€™Ãƒâ€ Ã¢â‚¬â„¢ÃƒÆ’Ã¢â‚¬Â ÃƒÂ¢Ã¢â€šÂ¬Ã¢â€žÂ¢ÃƒÆ’Ã†â€™ÃƒÂ¢Ã¢â€šÂ¬Ã‚Â ÃƒÆ’Ã‚Â¢ÃƒÂ¢Ã¢â‚¬Å¡Ã‚Â¬ÃƒÂ¢Ã¢â‚¬Å¾Ã‚Â¢ÃƒÆ’Ã†â€™Ãƒâ€ Ã¢â‚¬â„¢ÃƒÆ’Ã‚Â¢ÃƒÂ¢Ã¢â‚¬Å¡Ã‚Â¬Ãƒâ€¦Ã‚Â¡ÃƒÆ’Ã†â€™ÃƒÂ¢Ã¢â€šÂ¬Ã…Â¡ÃƒÆ’Ã¢â‚¬Å¡Ãƒâ€šÃ‚Â¢ÃƒÆ’Ã†â€™Ãƒâ€ Ã¢â‚¬â„¢ÃƒÆ’Ã¢â‚¬Â ÃƒÂ¢Ã¢â€šÂ¬Ã¢â€žÂ¢ÃƒÆ’Ã†â€™ÃƒÂ¢Ã¢â€šÂ¬Ã…Â¡ÃƒÆ’Ã¢â‚¬Å¡Ãƒâ€šÃ‚Â¢ÃƒÆ’Ã†â€™Ãƒâ€ Ã¢â‚¬â„¢ÃƒÆ’Ã¢â‚¬Å¡Ãƒâ€šÃ‚Â¢ÃƒÆ’Ã†â€™Ãƒâ€šÃ‚Â¢ÃƒÆ’Ã‚Â¢ÃƒÂ¢Ã¢â‚¬Å¡Ã‚Â¬Ãƒâ€¦Ã‚Â¡ÃƒÆ’Ã¢â‚¬Å¡Ãƒâ€šÃ‚Â¬ÃƒÆ’Ã†â€™ÃƒÂ¢Ã¢â€šÂ¬Ã‚Â¦ÃƒÆ’Ã¢â‚¬Å¡Ãƒâ€šÃ‚Â¡ÃƒÆ’Ã†â€™Ãƒâ€ Ã¢â‚¬â„¢ÃƒÆ’Ã‚Â¢ÃƒÂ¢Ã¢â‚¬Å¡Ã‚Â¬Ãƒâ€¦Ã‚Â¡ÃƒÆ’Ã†â€™ÃƒÂ¢Ã¢â€šÂ¬Ã…Â¡ÃƒÆ’Ã¢â‚¬Å¡Ãƒâ€šÃ‚Â¬ÃƒÆ’Ã†â€™Ãƒâ€ Ã¢â‚¬â„¢ÃƒÆ’Ã¢â‚¬Â ÃƒÂ¢Ã¢â€šÂ¬Ã¢â€žÂ¢ÃƒÆ’Ã†â€™ÃƒÂ¢Ã¢â€šÂ¬Ã…Â¡ÃƒÆ’Ã¢â‚¬Å¡Ãƒâ€šÃ‚Â¢ÃƒÆ’Ã†â€™Ãƒâ€ Ã¢â‚¬â„¢ÃƒÆ’Ã¢â‚¬Å¡Ãƒâ€šÃ‚Â¢ÃƒÆ’Ã†â€™Ãƒâ€šÃ‚Â¢ÃƒÆ’Ã‚Â¢ÃƒÂ¢Ã¢â€šÂ¬Ã…Â¡Ãƒâ€šÃ‚Â¬ÃƒÆ’Ã¢â‚¬Â¦Ãƒâ€šÃ‚Â¡ÃƒÆ’Ã†â€™ÃƒÂ¢Ã¢â€šÂ¬Ã…Â¡ÃƒÆ’Ã¢â‚¬Å¡Ãƒâ€šÃ‚Â¬ÃƒÆ’Ã†â€™Ãƒâ€ Ã¢â‚¬â„¢ÃƒÆ’Ã‚Â¢ÃƒÂ¢Ã¢â‚¬Å¡Ã‚Â¬Ãƒâ€šÃ‚Â¦ÃƒÆ’Ã†â€™Ãƒâ€šÃ‚Â¢ÃƒÆ’Ã‚Â¢ÃƒÂ¢Ã¢â€šÂ¬Ã…Â¡Ãƒâ€šÃ‚Â¬ÃƒÆ’Ã¢â‚¬Â¦ÃƒÂ¢Ã¢â€šÂ¬Ã…â€œWk4), both systems experienced strong positive growth, with Monoculture slightly higher (10.370 g/day) than IMTA (9.087 g/day).</w:t>
-      </w:r>
-    </w:p>
-    <w:p>
-      <w:pPr>
-        <w:spacing w:line="360" w:lineRule="auto"/>
-        <w:rPr>
-          <w:rFonts w:ascii="Times New Roman" w:hAnsi="Times New Roman" w:cs="Times New Roman"/>
-        </w:rPr>
-      </w:pPr>
-      <w:r>
-        <w:rPr>
-          <w:rFonts w:ascii="Times New Roman" w:hAnsi="Times New Roman" w:cs="Times New Roman"/>
-        </w:rPr>
-        <w:t xml:space="preserve">A major divergence occurred in the Wk4ÃƒÆ’Ã†â€™Ãƒâ€ Ã¢â‚¬â„¢ÃƒÆ’Ã¢â‚¬Â ÃƒÂ¢Ã¢â€šÂ¬Ã¢â€žÂ¢ÃƒÆ’Ã†â€™ÃƒÂ¢Ã¢â€šÂ¬Ã‚Â ÃƒÆ’Ã‚Â¢ÃƒÂ¢Ã¢â‚¬Å¡Ã‚Â¬ÃƒÂ¢Ã¢â‚¬Å¾Ã‚Â¢ÃƒÆ’Ã†â€™Ãƒâ€ Ã¢â‚¬â„¢ÃƒÆ’Ã‚Â¢ÃƒÂ¢Ã¢â‚¬Å¡Ã‚Â¬Ãƒâ€¦Ã‚Â¡ÃƒÆ’Ã†â€™ÃƒÂ¢Ã¢â€šÂ¬Ã…Â¡ÃƒÆ’Ã¢â‚¬Å¡Ãƒâ€šÃ‚Â¢ÃƒÆ’Ã†â€™Ãƒâ€ Ã¢â‚¬â„¢ÃƒÆ’Ã¢â‚¬Â ÃƒÂ¢Ã¢â€šÂ¬Ã¢â€žÂ¢ÃƒÆ’Ã†â€™ÃƒÂ¢Ã¢â€šÂ¬Ã…Â¡ÃƒÆ’Ã¢â‚¬Å¡Ãƒâ€šÃ‚Â¢ÃƒÆ’Ã†â€™Ãƒâ€ Ã¢â‚¬â„¢ÃƒÆ’Ã¢â‚¬Å¡Ãƒâ€šÃ‚Â¢ÃƒÆ’Ã†â€™Ãƒâ€šÃ‚Â¢ÃƒÆ’Ã‚Â¢ÃƒÂ¢Ã¢â‚¬Å¡Ã‚Â¬Ãƒâ€¦Ã‚Â¡ÃƒÆ’Ã¢â‚¬Å¡Ãƒâ€šÃ‚Â¬ÃƒÆ’Ã†â€™ÃƒÂ¢Ã¢â€šÂ¬Ã‚Â¦ÃƒÆ’Ã¢â‚¬Å¡Ãƒâ€šÃ‚Â¡ÃƒÆ’Ã†â€™Ãƒâ€ Ã¢â‚¬â„¢ÃƒÆ’Ã‚Â¢ÃƒÂ¢Ã¢â‚¬Å¡Ã‚Â¬Ãƒâ€¦Ã‚Â¡ÃƒÆ’Ã†â€™ÃƒÂ¢Ã¢â€šÂ¬Ã…Â¡ÃƒÆ’Ã¢â‚¬Å¡Ãƒâ€šÃ‚Â¬ÃƒÆ’Ã†â€™Ãƒâ€ Ã¢â‚¬â„¢ÃƒÆ’Ã¢â‚¬Â ÃƒÂ¢Ã¢â€šÂ¬Ã¢â€žÂ¢ÃƒÆ’Ã†â€™ÃƒÂ¢Ã¢â€šÂ¬Ã…Â¡ÃƒÆ’Ã¢â‚¬Å¡Ãƒâ€šÃ‚Â¢ÃƒÆ’Ã†â€™Ãƒâ€ Ã¢â‚¬â„¢ÃƒÆ’Ã¢â‚¬Å¡Ãƒâ€šÃ‚Â¢ÃƒÆ’Ã†â€™Ãƒâ€šÃ‚Â¢ÃƒÆ’Ã‚Â¢ÃƒÂ¢Ã¢â€šÂ¬Ã…Â¡Ãƒâ€šÃ‚Â¬ÃƒÆ’Ã¢â‚¬Â¦Ãƒâ€šÃ‚Â¡ÃƒÆ’Ã†â€™ÃƒÂ¢Ã¢â€šÂ¬Ã…Â¡ÃƒÆ’Ã¢â‚¬Å¡Ãƒâ€šÃ‚Â¬ÃƒÆ’Ã†â€™Ãƒâ€ Ã¢â‚¬â„¢ÃƒÆ’Ã‚Â¢ÃƒÂ¢Ã¢â‚¬Å¡Ã‚Â¬Ãƒâ€šÃ‚Â¦ÃƒÆ’Ã†â€™Ãƒâ€šÃ‚Â¢ÃƒÆ’Ã‚Â¢ÃƒÂ¢Ã¢â€šÂ¬Ã…Â¡Ãƒâ€šÃ‚Â¬ÃƒÆ’Ã¢â‚¬Â¦ÃƒÂ¢Ã¢â€šÂ¬Ã…â€œWk5 interval, where the Monoculture system showed a severe drop in growth (-27.608 g/day), while the IMTA system only recorded a minor decline (-2.266 g/day), indicating greater stability in the IMTA setup. In the final interval (Wk5ÃƒÆ’Ã†â€™Ãƒâ€ Ã¢â‚¬â„¢ÃƒÆ’Ã¢â‚¬Â ÃƒÂ¢Ã¢â€šÂ¬Ã¢â€žÂ¢ÃƒÆ’Ã†â€™ÃƒÂ¢Ã¢â€šÂ¬Ã‚Â ÃƒÆ’Ã‚Â¢ÃƒÂ¢Ã¢â‚¬Å¡Ã‚Â¬ÃƒÂ¢Ã¢â‚¬Å¾Ã‚Â¢ÃƒÆ’Ã†â€™Ãƒâ€ Ã¢â‚¬â„¢ÃƒÆ’Ã‚Â¢ÃƒÂ¢Ã¢â‚¬Å¡Ã‚Â¬Ãƒâ€¦Ã‚Â¡ÃƒÆ’Ã†â€™ÃƒÂ¢Ã¢â€šÂ¬Ã…Â¡ÃƒÆ’Ã¢â‚¬Å¡Ãƒâ€šÃ‚Â¢ÃƒÆ’Ã†â€™Ãƒâ€ Ã¢â‚¬â„¢ÃƒÆ’Ã¢â‚¬Â ÃƒÂ¢Ã¢â€šÂ¬Ã¢â€žÂ¢ÃƒÆ’Ã†â€™ÃƒÂ¢Ã¢â€šÂ¬Ã…Â¡ÃƒÆ’Ã¢â‚¬Å¡Ãƒâ€šÃ‚Â¢ÃƒÆ’Ã†â€™Ãƒâ€ Ã¢â‚¬â„¢ÃƒÆ’Ã¢â‚¬Å¡Ãƒâ€šÃ‚Â¢ÃƒÆ’Ã†â€™Ãƒâ€šÃ‚Â¢ÃƒÆ’Ã‚Â¢ÃƒÂ¢Ã¢â‚¬Å¡Ã‚Â¬Ãƒâ€¦Ã‚Â¡ÃƒÆ’Ã¢â‚¬Å¡Ãƒâ€šÃ‚Â¬ÃƒÆ’Ã†â€™ÃƒÂ¢Ã¢â€šÂ¬Ã‚Â¦ÃƒÆ’Ã¢â‚¬Å¡Ãƒâ€šÃ‚Â¡ÃƒÆ’Ã†â€™Ãƒâ€ Ã¢â‚¬â„¢ÃƒÆ’Ã‚Â¢ÃƒÂ¢Ã¢â‚¬Å¡Ã‚Â¬Ãƒâ€¦Ã‚Â¡ÃƒÆ’Ã†â€™ÃƒÂ¢Ã¢â€šÂ¬Ã…Â¡ÃƒÆ’Ã¢â‚¬Å¡Ãƒâ€šÃ‚Â¬ÃƒÆ’Ã†â€™Ãƒâ€ Ã¢â‚¬â„¢ÃƒÆ’Ã¢â‚¬Â ÃƒÂ¢Ã¢â€šÂ¬Ã¢â€žÂ¢ÃƒÆ’Ã†â€™ÃƒÂ¢Ã¢â€šÂ¬Ã…Â¡ÃƒÆ’Ã¢â‚¬Å¡Ãƒâ€šÃ‚Â¢ÃƒÆ’Ã†â€™Ãƒâ€ Ã¢â‚¬â„¢ÃƒÆ’Ã¢â‚¬Å¡Ãƒâ€šÃ‚Â¢ÃƒÆ’Ã†â€™Ãƒâ€šÃ‚Â¢ÃƒÆ’Ã‚Â¢ÃƒÂ¢Ã¢â€šÂ¬Ã…Â¡Ãƒâ€šÃ‚Â¬ÃƒÆ’Ã¢â‚¬Â¦Ãƒâ€šÃ‚Â¡ÃƒÆ’Ã†â€™ÃƒÂ¢Ã¢â€šÂ¬Ã…Â¡ÃƒÆ’Ã¢â‚¬Å¡Ãƒâ€šÃ‚Â¬ÃƒÆ’Ã†â€™Ãƒâ€ Ã¢â‚¬â„¢ÃƒÆ’Ã‚Â¢ÃƒÂ¢Ã¢â‚¬Å¡Ã‚Â¬Ãƒâ€šÃ‚Â¦ÃƒÆ’Ã†â€™Ãƒâ€šÃ‚Â¢ÃƒÆ’Ã‚Â¢ÃƒÂ¢Ã¢â€šÂ¬Ã…Â¡Ãƒâ€šÃ‚Â¬ÃƒÆ’Ã¢â‚¬Â¦ÃƒÂ¢Ã¢â€šÂ¬Ã…â€œWk6), both systems recovered again, with Monoculture reaching the highest AGR (13.854 g/day) and IMTA recording 8.307 g/day. Overall, although the Monoculture system achieved higher peak growth rates, the IMTA system demonstrated more stable and consistent growth performance, </w:t>
+        <w:t xml:space="preserve"> in IMTA and Monoculture systems across four sampling intervals. Overall, both systems show fluctuating growth patterns, including periods of weight loss and recovery. In the early phase (Wk2ÃƒÆ’Ã†â€™Ãƒâ€ Ã¢â‚¬â„¢ÃƒÆ’Ã¢â‚¬Â ÃƒÂ¢Ã¢â€šÂ¬Ã¢â€žÂ¢ÃƒÆ’Ã†â€™ÃƒÂ¢Ã¢â€šÂ¬Ã‚Â ÃƒÆ’Ã‚Â¢ÃƒÂ¢Ã¢â‚¬Å¡Ã‚Â¬ÃƒÂ¢Ã¢â‚¬Å¾Ã‚Â¢ÃƒÆ’Ã†â€™Ãƒâ€ Ã¢â‚¬â„¢ÃƒÆ’Ã‚Â¢ÃƒÂ¢Ã¢â‚¬Å¡Ã‚Â¬Ãƒâ€šÃ‚Â ÃƒÆ’Ã†â€™Ãƒâ€šÃ‚Â¢ÃƒÆ’Ã‚Â¢ÃƒÂ¢Ã¢â€šÂ¬Ã…Â¡Ãƒâ€šÃ‚Â¬ÃƒÆ’Ã‚Â¢ÃƒÂ¢Ã¢â€šÂ¬Ã…Â¾Ãƒâ€šÃ‚Â¢ÃƒÆ’Ã†â€™Ãƒâ€ Ã¢â‚¬â„¢ÃƒÆ’Ã¢â‚¬Â ÃƒÂ¢Ã¢â€šÂ¬Ã¢â€žÂ¢ÃƒÆ’Ã†â€™Ãƒâ€šÃ‚Â¢ÃƒÆ’Ã‚Â¢ÃƒÂ¢Ã¢â€šÂ¬Ã…Â¡Ãƒâ€šÃ‚Â¬ÃƒÆ’Ã¢â‚¬Å¡Ãƒâ€šÃ‚Â ÃƒÆ’Ã†â€™Ãƒâ€ Ã¢â‚¬â„¢ÃƒÆ’Ã¢â‚¬Å¡Ãƒâ€šÃ‚Â¢ÃƒÆ’Ã†â€™Ãƒâ€šÃ‚Â¢ÃƒÆ’Ã‚Â¢ÃƒÂ¢Ã¢â‚¬Å¡Ã‚Â¬Ãƒâ€¦Ã‚Â¡ÃƒÆ’Ã¢â‚¬Å¡Ãƒâ€šÃ‚Â¬ÃƒÆ’Ã†â€™Ãƒâ€šÃ‚Â¢ÃƒÆ’Ã‚Â¢ÃƒÂ¢Ã¢â‚¬Å¡Ã‚Â¬Ãƒâ€¦Ã‚Â¾ÃƒÆ’Ã¢â‚¬Å¡Ãƒâ€šÃ‚Â¢ÃƒÆ’Ã†â€™Ãƒâ€ Ã¢â‚¬â„¢ÃƒÆ’Ã¢â‚¬Â ÃƒÂ¢Ã¢â€šÂ¬Ã¢â€žÂ¢ÃƒÆ’Ã†â€™ÃƒÂ¢Ã¢â€šÂ¬Ã‚Â ÃƒÆ’Ã‚Â¢ÃƒÂ¢Ã¢â‚¬Å¡Ã‚Â¬ÃƒÂ¢Ã¢â‚¬Å¾Ã‚Â¢ÃƒÆ’Ã†â€™Ãƒâ€ Ã¢â‚¬â„¢ÃƒÆ’Ã¢â‚¬Å¡Ãƒâ€šÃ‚Â¢ÃƒÆ’Ã†â€™Ãƒâ€šÃ‚Â¢ÃƒÆ’Ã‚Â¢ÃƒÂ¢Ã¢â‚¬Å¡Ã‚Â¬Ãƒâ€¦Ã‚Â¡ÃƒÆ’Ã¢â‚¬Å¡Ãƒâ€šÃ‚Â¬ÃƒÆ’Ã†â€™ÃƒÂ¢Ã¢â€šÂ¬Ã‚Â¦ÃƒÆ’Ã¢â‚¬Å¡Ãƒâ€šÃ‚Â¡ÃƒÆ’Ã†â€™Ãƒâ€ Ã¢â‚¬â„¢ÃƒÆ’Ã¢â‚¬Â ÃƒÂ¢Ã¢â€šÂ¬Ã¢â€žÂ¢ÃƒÆ’Ã†â€™Ãƒâ€šÃ‚Â¢ÃƒÆ’Ã‚Â¢ÃƒÂ¢Ã¢â€šÂ¬Ã…Â¡Ãƒâ€šÃ‚Â¬ÃƒÆ’Ã¢â‚¬Â¦Ãƒâ€šÃ‚Â¡ÃƒÆ’Ã†â€™Ãƒâ€ Ã¢â‚¬â„¢ÃƒÆ’Ã‚Â¢ÃƒÂ¢Ã¢â‚¬Å¡Ã‚Â¬Ãƒâ€¦Ã‚Â¡ÃƒÆ’Ã†â€™ÃƒÂ¢Ã¢â€šÂ¬Ã…Â¡ÃƒÆ’Ã¢â‚¬Å¡Ãƒâ€šÃ‚Â¢ÃƒÆ’Ã†â€™Ãƒâ€ Ã¢â‚¬â„¢ÃƒÆ’Ã¢â‚¬Â ÃƒÂ¢Ã¢â€šÂ¬Ã¢â€žÂ¢ÃƒÆ’Ã†â€™ÃƒÂ¢Ã¢â€šÂ¬Ã‚Â ÃƒÆ’Ã‚Â¢ÃƒÂ¢Ã¢â‚¬Å¡Ã‚Â¬ÃƒÂ¢Ã¢â‚¬Å¾Ã‚Â¢ÃƒÆ’Ã†â€™Ãƒâ€ Ã¢â‚¬â„¢ÃƒÆ’Ã‚Â¢ÃƒÂ¢Ã¢â‚¬Å¡Ã‚Â¬Ãƒâ€šÃ‚Â ÃƒÆ’Ã†â€™Ãƒâ€šÃ‚Â¢ÃƒÆ’Ã‚Â¢ÃƒÂ¢Ã¢â€šÂ¬Ã…Â¡Ãƒâ€šÃ‚Â¬ÃƒÆ’Ã‚Â¢ÃƒÂ¢Ã¢â€šÂ¬Ã…Â¾Ãƒâ€šÃ‚Â¢ÃƒÆ’Ã†â€™Ãƒâ€ Ã¢â‚¬â„¢ÃƒÆ’Ã¢â‚¬Â ÃƒÂ¢Ã¢â€šÂ¬Ã¢â€žÂ¢ÃƒÆ’Ã†â€™Ãƒâ€šÃ‚Â¢ÃƒÆ’Ã‚Â¢ÃƒÂ¢Ã¢â€šÂ¬Ã…Â¡Ãƒâ€šÃ‚Â¬ÃƒÆ’Ã¢â‚¬Â¦Ãƒâ€šÃ‚Â¡ÃƒÆ’Ã†â€™Ãƒâ€ Ã¢â‚¬â„¢ÃƒÆ’Ã‚Â¢ÃƒÂ¢Ã¢â‚¬Å¡Ã‚Â¬Ãƒâ€¦Ã‚Â¡ÃƒÆ’Ã†â€™ÃƒÂ¢Ã¢â€šÂ¬Ã…Â¡ÃƒÆ’Ã¢â‚¬Å¡Ãƒâ€šÃ‚Â¢ÃƒÆ’Ã†â€™Ãƒâ€ Ã¢â‚¬â„¢ÃƒÆ’Ã¢â‚¬Â ÃƒÂ¢Ã¢â€šÂ¬Ã¢â€žÂ¢ÃƒÆ’Ã†â€™ÃƒÂ¢Ã¢â€šÂ¬Ã‚Â ÃƒÆ’Ã‚Â¢ÃƒÂ¢Ã¢â‚¬Å¡Ã‚Â¬ÃƒÂ¢Ã¢â‚¬Å¾Ã‚Â¢ÃƒÆ’Ã†â€™Ãƒâ€ Ã¢â‚¬â„¢ÃƒÆ’Ã‚Â¢ÃƒÂ¢Ã¢â‚¬Å¡Ã‚Â¬Ãƒâ€¦Ã‚Â¡ÃƒÆ’Ã†â€™ÃƒÂ¢Ã¢â€šÂ¬Ã…Â¡ÃƒÆ’Ã¢â‚¬Å¡Ãƒâ€šÃ‚Â¢ÃƒÆ’Ã†â€™Ãƒâ€ Ã¢â‚¬â„¢ÃƒÆ’Ã¢â‚¬Â ÃƒÂ¢Ã¢â€šÂ¬Ã¢â€žÂ¢ÃƒÆ’Ã†â€™ÃƒÂ¢Ã¢â€šÂ¬Ã…Â¡ÃƒÆ’Ã¢â‚¬Å¡Ãƒâ€šÃ‚Â¢ÃƒÆ’Ã†â€™Ãƒâ€ Ã¢â‚¬â„¢ÃƒÆ’Ã¢â‚¬Å¡Ãƒâ€šÃ‚Â¢ÃƒÆ’Ã†â€™Ãƒâ€šÃ‚Â¢ÃƒÆ’Ã‚Â¢ÃƒÂ¢Ã¢â‚¬Å¡Ã‚Â¬Ãƒâ€¦Ã‚Â¡ÃƒÆ’Ã¢â‚¬Å¡Ãƒâ€šÃ‚Â¬ÃƒÆ’Ã†â€™ÃƒÂ¢Ã¢â€šÂ¬Ã‚Â¦ÃƒÆ’Ã¢â‚¬Å¡Ãƒâ€šÃ‚Â¡ÃƒÆ’Ã†â€™Ãƒâ€ Ã¢â‚¬â„¢ÃƒÆ’Ã‚Â¢ÃƒÂ¢Ã¢â‚¬Å¡Ã‚Â¬Ãƒâ€¦Ã‚Â¡ÃƒÆ’Ã†â€™ÃƒÂ¢Ã¢â€šÂ¬Ã…Â¡ÃƒÆ’Ã¢â‚¬Å¡Ãƒâ€šÃ‚Â¬ÃƒÆ’Ã†â€™Ãƒâ€ Ã¢â‚¬â„¢ÃƒÆ’Ã¢â‚¬Â ÃƒÂ¢Ã¢â€šÂ¬Ã¢â€žÂ¢ÃƒÆ’Ã†â€™Ãƒâ€šÃ‚Â¢ÃƒÆ’Ã‚Â¢ÃƒÂ¢Ã¢â€šÂ¬Ã…Â¡Ãƒâ€šÃ‚Â¬ÃƒÆ’Ã¢â‚¬Å¡Ãƒâ€šÃ‚Â¦ÃƒÆ’Ã†â€™Ãƒâ€ Ã¢â‚¬â„¢ÃƒÆ’Ã‚Â¢ÃƒÂ¢Ã¢â‚¬Å¡Ã‚Â¬Ãƒâ€¦Ã‚Â¡ÃƒÆ’Ã†â€™ÃƒÂ¢Ã¢â€šÂ¬Ã…Â¡ÃƒÆ’Ã¢â‚¬Å¡Ãƒâ€šÃ‚Â¡ÃƒÆ’Ã†â€™Ãƒâ€ Ã¢â‚¬â„¢ÃƒÆ’Ã¢â‚¬Â ÃƒÂ¢Ã¢â€šÂ¬Ã¢â€žÂ¢ÃƒÆ’Ã†â€™ÃƒÂ¢Ã¢â€šÂ¬Ã‚Â ÃƒÆ’Ã‚Â¢ÃƒÂ¢Ã¢â‚¬Å¡Ã‚Â¬ÃƒÂ¢Ã¢â‚¬Å¾Ã‚Â¢ÃƒÆ’Ã†â€™Ãƒâ€ Ã¢â‚¬â„¢ÃƒÆ’Ã¢â‚¬Å¡Ãƒâ€šÃ‚Â¢ÃƒÆ’Ã†â€™Ãƒâ€šÃ‚Â¢ÃƒÆ’Ã‚Â¢ÃƒÂ¢Ã¢â‚¬Å¡Ã‚Â¬Ãƒâ€¦Ã‚Â¡ÃƒÆ’Ã¢â‚¬Å¡Ãƒâ€šÃ‚Â¬ÃƒÆ’Ã†â€™ÃƒÂ¢Ã¢â€šÂ¬Ã‚Â¦ÃƒÆ’Ã¢â‚¬Å¡Ãƒâ€šÃ‚Â¡ÃƒÆ’Ã†â€™Ãƒâ€ Ã¢â‚¬â„¢ÃƒÆ’Ã¢â‚¬Â ÃƒÂ¢Ã¢â€šÂ¬Ã¢â€žÂ¢ÃƒÆ’Ã†â€™Ãƒâ€šÃ‚Â¢ÃƒÆ’Ã‚Â¢ÃƒÂ¢Ã¢â€šÂ¬Ã…Â¡Ãƒâ€šÃ‚Â¬ÃƒÆ’Ã¢â‚¬Â¦Ãƒâ€šÃ‚Â¡ÃƒÆ’Ã†â€™Ãƒâ€ Ã¢â‚¬â„¢ÃƒÆ’Ã‚Â¢ÃƒÂ¢Ã¢â‚¬Å¡Ã‚Â¬Ãƒâ€¦Ã‚Â¡ÃƒÆ’Ã†â€™ÃƒÂ¢Ã¢â€šÂ¬Ã…Â¡ÃƒÆ’Ã¢â‚¬Å¡Ãƒâ€šÃ‚Â¬ÃƒÆ’Ã†â€™Ãƒâ€ Ã¢â‚¬â„¢ÃƒÆ’Ã¢â‚¬Â ÃƒÂ¢Ã¢â€šÂ¬Ã¢â€žÂ¢ÃƒÆ’Ã†â€™ÃƒÂ¢Ã¢â€šÂ¬Ã‚Â ÃƒÆ’Ã‚Â¢ÃƒÂ¢Ã¢â‚¬Å¡Ã‚Â¬ÃƒÂ¢Ã¢â‚¬Å¾Ã‚Â¢ÃƒÆ’Ã†â€™Ãƒâ€ Ã¢â‚¬â„¢ÃƒÆ’Ã‚Â¢ÃƒÂ¢Ã¢â‚¬Å¡Ã‚Â¬Ãƒâ€šÃ‚Â ÃƒÆ’Ã†â€™Ãƒâ€šÃ‚Â¢ÃƒÆ’Ã‚Â¢ÃƒÂ¢Ã¢â€šÂ¬Ã…Â¡Ãƒâ€šÃ‚Â¬ÃƒÆ’Ã‚Â¢ÃƒÂ¢Ã¢â€šÂ¬Ã…Â¾Ãƒâ€šÃ‚Â¢ÃƒÆ’Ã†â€™Ãƒâ€ Ã¢â‚¬â„¢ÃƒÆ’Ã¢â‚¬Â ÃƒÂ¢Ã¢â€šÂ¬Ã¢â€žÂ¢ÃƒÆ’Ã†â€™Ãƒâ€šÃ‚Â¢ÃƒÆ’Ã‚Â¢ÃƒÂ¢Ã¢â€šÂ¬Ã…Â¡Ãƒâ€šÃ‚Â¬ÃƒÆ’Ã¢â‚¬Â¦Ãƒâ€šÃ‚Â¡ÃƒÆ’Ã†â€™Ãƒâ€ Ã¢â‚¬â„¢ÃƒÆ’Ã‚Â¢ÃƒÂ¢Ã¢â‚¬Å¡Ã‚Â¬Ãƒâ€¦Ã‚Â¡ÃƒÆ’Ã†â€™ÃƒÂ¢Ã¢â€šÂ¬Ã…Â¡ÃƒÆ’Ã¢â‚¬Å¡Ãƒâ€šÃ‚Â¢ÃƒÆ’Ã†â€™Ãƒâ€ Ã¢â‚¬â„¢ÃƒÆ’Ã¢â‚¬Â ÃƒÂ¢Ã¢â€šÂ¬Ã¢â€žÂ¢ÃƒÆ’Ã†â€™ÃƒÂ¢Ã¢â€šÂ¬Ã‚Â ÃƒÆ’Ã‚Â¢ÃƒÂ¢Ã¢â‚¬Å¡Ã‚Â¬ÃƒÂ¢Ã¢â‚¬Å¾Ã‚Â¢ÃƒÆ’Ã†â€™Ãƒâ€ Ã¢â‚¬â„¢ÃƒÆ’Ã‚Â¢ÃƒÂ¢Ã¢â‚¬Å¡Ã‚Â¬Ãƒâ€¦Ã‚Â¡ÃƒÆ’Ã†â€™ÃƒÂ¢Ã¢â€šÂ¬Ã…Â¡ÃƒÆ’Ã¢â‚¬Å¡Ãƒâ€šÃ‚Â¢ÃƒÆ’Ã†â€™Ãƒâ€ Ã¢â‚¬â„¢ÃƒÆ’Ã¢â‚¬Â ÃƒÂ¢Ã¢â€šÂ¬Ã¢â€žÂ¢ÃƒÆ’Ã†â€™ÃƒÂ¢Ã¢â€šÂ¬Ã…Â¡ÃƒÆ’Ã¢â‚¬Å¡Ãƒâ€šÃ‚Â¢ÃƒÆ’Ã†â€™Ãƒâ€ Ã¢â‚¬â„¢ÃƒÆ’Ã¢â‚¬Å¡Ãƒâ€šÃ‚Â¢ÃƒÆ’Ã†â€™Ãƒâ€šÃ‚Â¢ÃƒÆ’Ã‚Â¢ÃƒÂ¢Ã¢â€šÂ¬Ã…Â¡Ãƒâ€šÃ‚Â¬ÃƒÆ’Ã¢â‚¬Â¦Ãƒâ€šÃ‚Â¡ÃƒÆ’Ã†â€™ÃƒÂ¢Ã¢â€šÂ¬Ã…Â¡ÃƒÆ’Ã¢â‚¬Å¡Ãƒâ€šÃ‚Â¬ÃƒÆ’Ã†â€™Ãƒâ€ Ã¢â‚¬â„¢ÃƒÆ’Ã‚Â¢ÃƒÂ¢Ã¢â‚¬Å¡Ã‚Â¬Ãƒâ€šÃ‚Â¦ÃƒÆ’Ã†â€™ÃƒÂ¢Ã¢â€šÂ¬Ã…Â¡ÃƒÆ’Ã¢â‚¬Å¡Ãƒâ€šÃ‚Â¡ÃƒÆ’Ã†â€™Ãƒâ€ Ã¢â‚¬â„¢ÃƒÆ’Ã¢â‚¬Â ÃƒÂ¢Ã¢â€šÂ¬Ã¢â€žÂ¢ÃƒÆ’Ã†â€™Ãƒâ€šÃ‚Â¢ÃƒÆ’Ã‚Â¢ÃƒÂ¢Ã¢â€šÂ¬Ã…Â¡Ãƒâ€šÃ‚Â¬ÃƒÆ’Ã¢â‚¬Â¦Ãƒâ€šÃ‚Â¡ÃƒÆ’Ã†â€™Ãƒâ€ Ã¢â‚¬â„¢ÃƒÆ’Ã‚Â¢ÃƒÂ¢Ã¢â‚¬Å¡Ã‚Â¬Ãƒâ€¦Ã‚Â¡ÃƒÆ’Ã†â€™ÃƒÂ¢Ã¢â€šÂ¬Ã…Â¡ÃƒÆ’Ã¢â‚¬Å¡Ãƒâ€šÃ‚Â¬ÃƒÆ’Ã†â€™Ãƒâ€ Ã¢â‚¬â„¢ÃƒÆ’Ã¢â‚¬Â ÃƒÂ¢Ã¢â€šÂ¬Ã¢â€žÂ¢ÃƒÆ’Ã†â€™ÃƒÂ¢Ã¢â€šÂ¬Ã‚Â ÃƒÆ’Ã‚Â¢ÃƒÂ¢Ã¢â‚¬Å¡Ã‚Â¬ÃƒÂ¢Ã¢â‚¬Å¾Ã‚Â¢ÃƒÆ’Ã†â€™Ãƒâ€ Ã¢â‚¬â„¢ÃƒÆ’Ã¢â‚¬Å¡Ãƒâ€šÃ‚Â¢ÃƒÆ’Ã†â€™Ãƒâ€šÃ‚Â¢ÃƒÆ’Ã‚Â¢ÃƒÂ¢Ã¢â‚¬Å¡Ã‚Â¬Ãƒâ€¦Ã‚Â¡ÃƒÆ’Ã¢â‚¬Å¡Ãƒâ€šÃ‚Â¬ÃƒÆ’Ã†â€™ÃƒÂ¢Ã¢â€šÂ¬Ã…Â¡ÃƒÆ’Ã¢â‚¬Å¡Ãƒâ€šÃ‚Â¦ÃƒÆ’Ã†â€™Ãƒâ€ Ã¢â‚¬â„¢ÃƒÆ’Ã¢â‚¬Â ÃƒÂ¢Ã¢â€šÂ¬Ã¢â€žÂ¢ÃƒÆ’Ã†â€™ÃƒÂ¢Ã¢â€šÂ¬Ã…Â¡ÃƒÆ’Ã¢â‚¬Å¡Ãƒâ€šÃ‚Â¢ÃƒÆ’Ã†â€™Ãƒâ€ Ã¢â‚¬â„¢ÃƒÆ’Ã¢â‚¬Å¡Ãƒâ€šÃ‚Â¢ÃƒÆ’Ã†â€™Ãƒâ€šÃ‚Â¢ÃƒÆ’Ã‚Â¢ÃƒÂ¢Ã¢â€šÂ¬Ã…Â¡Ãƒâ€šÃ‚Â¬ÃƒÆ’Ã¢â‚¬Â¦Ãƒâ€šÃ‚Â¡ÃƒÆ’Ã†â€™ÃƒÂ¢Ã¢â€šÂ¬Ã…Â¡ÃƒÆ’Ã¢â‚¬Å¡Ãƒâ€šÃ‚Â¬ÃƒÆ’Ã†â€™Ãƒâ€ Ã¢â‚¬â„¢ÃƒÆ’Ã‚Â¢ÃƒÂ¢Ã¢â‚¬Å¡Ã‚Â¬Ãƒâ€šÃ‚Â¦ÃƒÆ’Ã†â€™Ãƒâ€šÃ‚Â¢ÃƒÆ’Ã‚Â¢ÃƒÂ¢Ã¢â€šÂ¬Ã…Â¡Ãƒâ€šÃ‚Â¬ÃƒÆ’Ã¢â‚¬Â¦ÃƒÂ¢Ã¢â€šÂ¬Ã…â€œWk3), both treatments recorded negative growth rates, with the IMTA system showing a sharper decline (-5.953 g/day) compared to the Monoculture (-2.916 g/day). During the recovery phase (Wk3ÃƒÆ’Ã†â€™Ãƒâ€ Ã¢â‚¬â„¢ÃƒÆ’Ã¢â‚¬Â ÃƒÂ¢Ã¢â€šÂ¬Ã¢â€žÂ¢ÃƒÆ’Ã†â€™ÃƒÂ¢Ã¢â€šÂ¬Ã‚Â ÃƒÆ’Ã‚Â¢ÃƒÂ¢Ã¢â‚¬Å¡Ã‚Â¬ÃƒÂ¢Ã¢â‚¬Å¾Ã‚Â¢ÃƒÆ’Ã†â€™Ãƒâ€ Ã¢â‚¬â„¢ÃƒÆ’Ã‚Â¢ÃƒÂ¢Ã¢â‚¬Å¡Ã‚Â¬Ãƒâ€šÃ‚Â ÃƒÆ’Ã†â€™Ãƒâ€šÃ‚Â¢ÃƒÆ’Ã‚Â¢ÃƒÂ¢Ã¢â€šÂ¬Ã…Â¡Ãƒâ€šÃ‚Â¬ÃƒÆ’Ã‚Â¢ÃƒÂ¢Ã¢â€šÂ¬Ã…Â¾Ãƒâ€šÃ‚Â¢ÃƒÆ’Ã†â€™Ãƒâ€ Ã¢â‚¬â„¢ÃƒÆ’Ã¢â‚¬Â ÃƒÂ¢Ã¢â€šÂ¬Ã¢â€žÂ¢ÃƒÆ’Ã†â€™Ãƒâ€šÃ‚Â¢ÃƒÆ’Ã‚Â¢ÃƒÂ¢Ã¢â€šÂ¬Ã…Â¡Ãƒâ€šÃ‚Â¬ÃƒÆ’Ã¢â‚¬Å¡Ãƒâ€šÃ‚Â ÃƒÆ’Ã†â€™Ãƒâ€ Ã¢â‚¬â„¢ÃƒÆ’Ã¢â‚¬Å¡Ãƒâ€šÃ‚Â¢ÃƒÆ’Ã†â€™Ãƒâ€šÃ‚Â¢ÃƒÆ’Ã‚Â¢ÃƒÂ¢Ã¢â‚¬Å¡Ã‚Â¬Ãƒâ€¦Ã‚Â¡ÃƒÆ’Ã¢â‚¬Å¡Ãƒâ€šÃ‚Â¬ÃƒÆ’Ã†â€™Ãƒâ€šÃ‚Â¢ÃƒÆ’Ã‚Â¢ÃƒÂ¢Ã¢â‚¬Å¡Ã‚Â¬Ãƒâ€¦Ã‚Â¾ÃƒÆ’Ã¢â‚¬Å¡Ãƒâ€šÃ‚Â¢ÃƒÆ’Ã†â€™Ãƒâ€ Ã¢â‚¬â„¢ÃƒÆ’Ã¢â‚¬Â ÃƒÂ¢Ã¢â€šÂ¬Ã¢â€žÂ¢ÃƒÆ’Ã†â€™ÃƒÂ¢Ã¢â€šÂ¬Ã‚Â ÃƒÆ’Ã‚Â¢ÃƒÂ¢Ã¢â‚¬Å¡Ã‚Â¬ÃƒÂ¢Ã¢â‚¬Å¾Ã‚Â¢ÃƒÆ’Ã†â€™Ãƒâ€ Ã¢â‚¬â„¢ÃƒÆ’Ã¢â‚¬Å¡Ãƒâ€šÃ‚Â¢ÃƒÆ’Ã†â€™Ãƒâ€šÃ‚Â¢ÃƒÆ’Ã‚Â¢ÃƒÂ¢Ã¢â‚¬Å¡Ã‚Â¬Ãƒâ€¦Ã‚Â¡ÃƒÆ’Ã¢â‚¬Å¡Ãƒâ€šÃ‚Â¬ÃƒÆ’Ã†â€™ÃƒÂ¢Ã¢â€šÂ¬Ã‚Â¦ÃƒÆ’Ã¢â‚¬Å¡Ãƒâ€šÃ‚Â¡ÃƒÆ’Ã†â€™Ãƒâ€ Ã¢â‚¬â„¢ÃƒÆ’Ã¢â‚¬Â ÃƒÂ¢Ã¢â€šÂ¬Ã¢â€žÂ¢ÃƒÆ’Ã†â€™Ãƒâ€šÃ‚Â¢ÃƒÆ’Ã‚Â¢ÃƒÂ¢Ã¢â€šÂ¬Ã…Â¡Ãƒâ€šÃ‚Â¬ÃƒÆ’Ã¢â‚¬Â¦Ãƒâ€šÃ‚Â¡ÃƒÆ’Ã†â€™Ãƒâ€ Ã¢â‚¬â„¢ÃƒÆ’Ã‚Â¢ÃƒÂ¢Ã¢â‚¬Å¡Ã‚Â¬Ãƒâ€¦Ã‚Â¡ÃƒÆ’Ã†â€™ÃƒÂ¢Ã¢â€šÂ¬Ã…Â¡ÃƒÆ’Ã¢â‚¬Å¡Ãƒâ€šÃ‚Â¢ÃƒÆ’Ã†â€™Ãƒâ€ Ã¢â‚¬â„¢ÃƒÆ’Ã¢â‚¬Â ÃƒÂ¢Ã¢â€šÂ¬Ã¢â€žÂ¢ÃƒÆ’Ã†â€™ÃƒÂ¢Ã¢â€šÂ¬Ã‚Â ÃƒÆ’Ã‚Â¢ÃƒÂ¢Ã¢â‚¬Å¡Ã‚Â¬ÃƒÂ¢Ã¢â‚¬Å¾Ã‚Â¢ÃƒÆ’Ã†â€™Ãƒâ€ Ã¢â‚¬â„¢ÃƒÆ’Ã‚Â¢ÃƒÂ¢Ã¢â‚¬Å¡Ã‚Â¬Ãƒâ€šÃ‚Â ÃƒÆ’Ã†â€™Ãƒâ€šÃ‚Â¢ÃƒÆ’Ã‚Â¢ÃƒÂ¢Ã¢â€šÂ¬Ã…Â¡Ãƒâ€šÃ‚Â¬ÃƒÆ’Ã‚Â¢ÃƒÂ¢Ã¢â€šÂ¬Ã…Â¾Ãƒâ€šÃ‚Â¢ÃƒÆ’Ã†â€™Ãƒâ€ Ã¢â‚¬â„¢ÃƒÆ’Ã¢â‚¬Â ÃƒÂ¢Ã¢â€šÂ¬Ã¢â€žÂ¢ÃƒÆ’Ã†â€™Ãƒâ€šÃ‚Â¢ÃƒÆ’Ã‚Â¢ÃƒÂ¢Ã¢â€šÂ¬Ã…Â¡Ãƒâ€šÃ‚Â¬ÃƒÆ’Ã¢â‚¬Â¦Ãƒâ€šÃ‚Â¡ÃƒÆ’Ã†â€™Ãƒâ€ Ã¢â‚¬â„¢ÃƒÆ’Ã‚Â¢ÃƒÂ¢Ã¢â‚¬Å¡Ã‚Â¬Ãƒâ€¦Ã‚Â¡ÃƒÆ’Ã†â€™ÃƒÂ¢Ã¢â€šÂ¬Ã…Â¡ÃƒÆ’Ã¢â‚¬Å¡Ãƒâ€šÃ‚Â¢ÃƒÆ’Ã†â€™Ãƒâ€ Ã¢â‚¬â„¢ÃƒÆ’Ã¢â‚¬Â ÃƒÂ¢Ã¢â€šÂ¬Ã¢â€žÂ¢ÃƒÆ’Ã†â€™ÃƒÂ¢Ã¢â€šÂ¬Ã‚Â ÃƒÆ’Ã‚Â¢ÃƒÂ¢Ã¢â‚¬Å¡Ã‚Â¬ÃƒÂ¢Ã¢â‚¬Å¾Ã‚Â¢ÃƒÆ’Ã†â€™Ãƒâ€ Ã¢â‚¬â„¢ÃƒÆ’Ã‚Â¢ÃƒÂ¢Ã¢â‚¬Å¡Ã‚Â¬Ãƒâ€¦Ã‚Â¡ÃƒÆ’Ã†â€™ÃƒÂ¢Ã¢â€šÂ¬Ã…Â¡ÃƒÆ’Ã¢â‚¬Å¡Ãƒâ€šÃ‚Â¢ÃƒÆ’Ã†â€™Ãƒâ€ Ã¢â‚¬â„¢ÃƒÆ’Ã¢â‚¬Â ÃƒÂ¢Ã¢â€šÂ¬Ã¢â€žÂ¢ÃƒÆ’Ã†â€™ÃƒÂ¢Ã¢â€šÂ¬Ã…Â¡ÃƒÆ’Ã¢â‚¬Å¡Ãƒâ€šÃ‚Â¢ÃƒÆ’Ã†â€™Ãƒâ€ Ã¢â‚¬â„¢ÃƒÆ’Ã¢â‚¬Å¡Ãƒâ€šÃ‚Â¢ÃƒÆ’Ã†â€™Ãƒâ€šÃ‚Â¢ÃƒÆ’Ã‚Â¢ÃƒÂ¢Ã¢â‚¬Å¡Ã‚Â¬Ãƒâ€¦Ã‚Â¡ÃƒÆ’Ã¢â‚¬Å¡Ãƒâ€šÃ‚Â¬ÃƒÆ’Ã†â€™ÃƒÂ¢Ã¢â€šÂ¬Ã‚Â¦ÃƒÆ’Ã¢â‚¬Å¡Ãƒâ€šÃ‚Â¡ÃƒÆ’Ã†â€™Ãƒâ€ Ã¢â‚¬â„¢ÃƒÆ’Ã‚Â¢ÃƒÂ¢Ã¢â‚¬Å¡Ã‚Â¬Ãƒâ€¦Ã‚Â¡ÃƒÆ’Ã†â€™ÃƒÂ¢Ã¢â€šÂ¬Ã…Â¡ÃƒÆ’Ã¢â‚¬Å¡Ãƒâ€šÃ‚Â¬ÃƒÆ’Ã†â€™Ãƒâ€ Ã¢â‚¬â„¢ÃƒÆ’Ã¢â‚¬Â ÃƒÂ¢Ã¢â€šÂ¬Ã¢â€žÂ¢ÃƒÆ’Ã†â€™Ãƒâ€šÃ‚Â¢ÃƒÆ’Ã‚Â¢ÃƒÂ¢Ã¢â€šÂ¬Ã…Â¡Ãƒâ€šÃ‚Â¬ÃƒÆ’Ã¢â‚¬Å¡Ãƒâ€šÃ‚Â¦ÃƒÆ’Ã†â€™Ãƒâ€ Ã¢â‚¬â„¢ÃƒÆ’Ã‚Â¢ÃƒÂ¢Ã¢â‚¬Å¡Ã‚Â¬Ãƒâ€¦Ã‚Â¡ÃƒÆ’Ã†â€™ÃƒÂ¢Ã¢â€šÂ¬Ã…Â¡ÃƒÆ’Ã¢â‚¬Å¡Ãƒâ€šÃ‚Â¡ÃƒÆ’Ã†â€™Ãƒâ€ Ã¢â‚¬â„¢ÃƒÆ’Ã¢â‚¬Â ÃƒÂ¢Ã¢â€šÂ¬Ã¢â€žÂ¢ÃƒÆ’Ã†â€™ÃƒÂ¢Ã¢â€šÂ¬Ã‚Â ÃƒÆ’Ã‚Â¢ÃƒÂ¢Ã¢â‚¬Å¡Ã‚Â¬ÃƒÂ¢Ã¢â‚¬Å¾Ã‚Â¢ÃƒÆ’Ã†â€™Ãƒâ€ Ã¢â‚¬â„¢ÃƒÆ’Ã¢â‚¬Å¡Ãƒâ€šÃ‚Â¢ÃƒÆ’Ã†â€™Ãƒâ€šÃ‚Â¢ÃƒÆ’Ã‚Â¢ÃƒÂ¢Ã¢â‚¬Å¡Ã‚Â¬Ãƒâ€¦Ã‚Â¡ÃƒÆ’Ã¢â‚¬Å¡Ãƒâ€šÃ‚Â¬ÃƒÆ’Ã†â€™ÃƒÂ¢Ã¢â€šÂ¬Ã‚Â¦ÃƒÆ’Ã¢â‚¬Å¡Ãƒâ€šÃ‚Â¡ÃƒÆ’Ã†â€™Ãƒâ€ Ã¢â‚¬â„¢ÃƒÆ’Ã¢â‚¬Â ÃƒÂ¢Ã¢â€šÂ¬Ã¢â€žÂ¢ÃƒÆ’Ã†â€™Ãƒâ€šÃ‚Â¢ÃƒÆ’Ã‚Â¢ÃƒÂ¢Ã¢â€šÂ¬Ã…Â¡Ãƒâ€šÃ‚Â¬ÃƒÆ’Ã¢â‚¬Â¦Ãƒâ€šÃ‚Â¡ÃƒÆ’Ã†â€™Ãƒâ€ Ã¢â‚¬â„¢ÃƒÆ’Ã‚Â¢ÃƒÂ¢Ã¢â‚¬Å¡Ã‚Â¬Ãƒâ€¦Ã‚Â¡ÃƒÆ’Ã†â€™ÃƒÂ¢Ã¢â€šÂ¬Ã…Â¡ÃƒÆ’Ã¢â‚¬Å¡Ãƒâ€šÃ‚Â¬ÃƒÆ’Ã†â€™Ãƒâ€ Ã¢â‚¬â„¢ÃƒÆ’Ã¢â‚¬Â ÃƒÂ¢Ã¢â€šÂ¬Ã¢â€žÂ¢ÃƒÆ’Ã†â€™ÃƒÂ¢Ã¢â€šÂ¬Ã‚Â ÃƒÆ’Ã‚Â¢ÃƒÂ¢Ã¢â‚¬Å¡Ã‚Â¬ÃƒÂ¢Ã¢â‚¬Å¾Ã‚Â¢ÃƒÆ’Ã†â€™Ãƒâ€ Ã¢â‚¬â„¢ÃƒÆ’Ã‚Â¢ÃƒÂ¢Ã¢â‚¬Å¡Ã‚Â¬Ãƒâ€šÃ‚Â ÃƒÆ’Ã†â€™Ãƒâ€šÃ‚Â¢ÃƒÆ’Ã‚Â¢ÃƒÂ¢Ã¢â€šÂ¬Ã…Â¡Ãƒâ€šÃ‚Â¬ÃƒÆ’Ã‚Â¢ÃƒÂ¢Ã¢â€šÂ¬Ã…Â¾Ãƒâ€šÃ‚Â¢ÃƒÆ’Ã†â€™Ãƒâ€ Ã¢â‚¬â„¢ÃƒÆ’Ã¢â‚¬Â ÃƒÂ¢Ã¢â€šÂ¬Ã¢â€žÂ¢ÃƒÆ’Ã†â€™Ãƒâ€šÃ‚Â¢ÃƒÆ’Ã‚Â¢ÃƒÂ¢Ã¢â€šÂ¬Ã…Â¡Ãƒâ€šÃ‚Â¬ÃƒÆ’Ã¢â‚¬Â¦Ãƒâ€šÃ‚Â¡ÃƒÆ’Ã†â€™Ãƒâ€ Ã¢â‚¬â„¢ÃƒÆ’Ã‚Â¢ÃƒÂ¢Ã¢â‚¬Å¡Ã‚Â¬Ãƒâ€¦Ã‚Â¡ÃƒÆ’Ã†â€™ÃƒÂ¢Ã¢â€šÂ¬Ã…Â¡ÃƒÆ’Ã¢â‚¬Å¡Ãƒâ€šÃ‚Â¢ÃƒÆ’Ã†â€™Ãƒâ€ Ã¢â‚¬â„¢ÃƒÆ’Ã¢â‚¬Â ÃƒÂ¢Ã¢â€šÂ¬Ã¢â€žÂ¢ÃƒÆ’Ã†â€™ÃƒÂ¢Ã¢â€šÂ¬Ã‚Â ÃƒÆ’Ã‚Â¢ÃƒÂ¢Ã¢â‚¬Å¡Ã‚Â¬ÃƒÂ¢Ã¢â‚¬Å¾Ã‚Â¢ÃƒÆ’Ã†â€™Ãƒâ€ Ã¢â‚¬â„¢ÃƒÆ’Ã‚Â¢ÃƒÂ¢Ã¢â‚¬Å¡Ã‚Â¬Ãƒâ€¦Ã‚Â¡ÃƒÆ’Ã†â€™ÃƒÂ¢Ã¢â€šÂ¬Ã…Â¡ÃƒÆ’Ã¢â‚¬Å¡Ãƒâ€šÃ‚Â¢ÃƒÆ’Ã†â€™Ãƒâ€ Ã¢â‚¬â„¢ÃƒÆ’Ã¢â‚¬Â ÃƒÂ¢Ã¢â€šÂ¬Ã¢â€žÂ¢ÃƒÆ’Ã†â€™ÃƒÂ¢Ã¢â€šÂ¬Ã…Â¡ÃƒÆ’Ã¢â‚¬Å¡Ãƒâ€šÃ‚Â¢ÃƒÆ’Ã†â€™Ãƒâ€ Ã¢â‚¬â„¢ÃƒÆ’Ã¢â‚¬Å¡Ãƒâ€šÃ‚Â¢ÃƒÆ’Ã†â€™Ãƒâ€šÃ‚Â¢ÃƒÆ’Ã‚Â¢ÃƒÂ¢Ã¢â€šÂ¬Ã…Â¡Ãƒâ€šÃ‚Â¬ÃƒÆ’Ã¢â‚¬Â¦Ãƒâ€šÃ‚Â¡ÃƒÆ’Ã†â€™ÃƒÂ¢Ã¢â€šÂ¬Ã…Â¡ÃƒÆ’Ã¢â‚¬Å¡Ãƒâ€šÃ‚Â¬ÃƒÆ’Ã†â€™Ãƒâ€ Ã¢â‚¬â„¢ÃƒÆ’Ã‚Â¢ÃƒÂ¢Ã¢â‚¬Å¡Ã‚Â¬Ãƒâ€šÃ‚Â¦ÃƒÆ’Ã†â€™ÃƒÂ¢Ã¢â€šÂ¬Ã…Â¡ÃƒÆ’Ã¢â‚¬Å¡Ãƒâ€šÃ‚Â¡ÃƒÆ’Ã†â€™Ãƒâ€ Ã¢â‚¬â„¢ÃƒÆ’Ã¢â‚¬Â ÃƒÂ¢Ã¢â€šÂ¬Ã¢â€žÂ¢ÃƒÆ’Ã†â€™Ãƒâ€šÃ‚Â¢ÃƒÆ’Ã‚Â¢ÃƒÂ¢Ã¢â€šÂ¬Ã…Â¡Ãƒâ€šÃ‚Â¬ÃƒÆ’Ã¢â‚¬Â¦Ãƒâ€šÃ‚Â¡ÃƒÆ’Ã†â€™Ãƒâ€ Ã¢â‚¬â„¢ÃƒÆ’Ã‚Â¢ÃƒÂ¢Ã¢â‚¬Å¡Ã‚Â¬Ãƒâ€¦Ã‚Â¡ÃƒÆ’Ã†â€™ÃƒÂ¢Ã¢â€šÂ¬Ã…Â¡ÃƒÆ’Ã¢â‚¬Å¡Ãƒâ€šÃ‚Â¬ÃƒÆ’Ã†â€™Ãƒâ€ Ã¢â‚¬â„¢ÃƒÆ’Ã¢â‚¬Â ÃƒÂ¢Ã¢â€šÂ¬Ã¢â€žÂ¢ÃƒÆ’Ã†â€™ÃƒÂ¢Ã¢â€šÂ¬Ã‚Â ÃƒÆ’Ã‚Â¢ÃƒÂ¢Ã¢â‚¬Å¡Ã‚Â¬ÃƒÂ¢Ã¢â‚¬Å¾Ã‚Â¢ÃƒÆ’Ã†â€™Ãƒâ€ Ã¢â‚¬â„¢ÃƒÆ’Ã¢â‚¬Å¡Ãƒâ€šÃ‚Â¢ÃƒÆ’Ã†â€™Ãƒâ€šÃ‚Â¢ÃƒÆ’Ã‚Â¢ÃƒÂ¢Ã¢â‚¬Å¡Ã‚Â¬Ãƒâ€¦Ã‚Â¡ÃƒÆ’Ã¢â‚¬Å¡Ãƒâ€šÃ‚Â¬ÃƒÆ’Ã†â€™ÃƒÂ¢Ã¢â€šÂ¬Ã…Â¡ÃƒÆ’Ã¢â‚¬Å¡Ãƒâ€šÃ‚Â¦ÃƒÆ’Ã†â€™Ãƒâ€ Ã¢â‚¬â„¢ÃƒÆ’Ã¢â‚¬Â ÃƒÂ¢Ã¢â€šÂ¬Ã¢â€žÂ¢ÃƒÆ’Ã†â€™ÃƒÂ¢Ã¢â€šÂ¬Ã…Â¡ÃƒÆ’Ã¢â‚¬Å¡Ãƒâ€šÃ‚Â¢ÃƒÆ’Ã†â€™Ãƒâ€ Ã¢â‚¬â„¢ÃƒÆ’Ã¢â‚¬Å¡Ãƒâ€šÃ‚Â¢ÃƒÆ’Ã†â€™Ãƒâ€šÃ‚Â¢ÃƒÆ’Ã‚Â¢ÃƒÂ¢Ã¢â€šÂ¬Ã…Â¡Ãƒâ€šÃ‚Â¬ÃƒÆ’Ã¢â‚¬Â¦Ãƒâ€šÃ‚Â¡ÃƒÆ’Ã†â€™ÃƒÂ¢Ã¢â€šÂ¬Ã…Â¡ÃƒÆ’Ã¢â‚¬Å¡Ãƒâ€šÃ‚Â¬ÃƒÆ’Ã†â€™Ãƒâ€ Ã¢â‚¬â„¢ÃƒÆ’Ã‚Â¢ÃƒÂ¢Ã¢â‚¬Å¡Ã‚Â¬Ãƒâ€šÃ‚Â¦ÃƒÆ’Ã†â€™Ãƒâ€šÃ‚Â¢ÃƒÆ’Ã‚Â¢ÃƒÂ¢Ã¢â€šÂ¬Ã…Â¡Ãƒâ€šÃ‚Â¬ÃƒÆ’Ã¢â‚¬Â¦ÃƒÂ¢Ã¢â€šÂ¬Ã…â€œWk4), both systems experienced strong positive growth, with Monoculture slightly higher (10.370 g/day) than IMTA (9.087 g/day).</w:t>
+      </w:r>
+    </w:p>
+    <w:p>
+      <w:pPr>
+        <w:spacing w:line="360" w:lineRule="auto"/>
+        <w:rPr>
+          <w:rFonts w:ascii="Times New Roman" w:hAnsi="Times New Roman" w:cs="Times New Roman"/>
+        </w:rPr>
+      </w:pPr>
+      <w:r>
+        <w:rPr>
+          <w:rFonts w:ascii="Times New Roman" w:hAnsi="Times New Roman" w:cs="Times New Roman"/>
+        </w:rPr>
+        <w:t xml:space="preserve">A major divergence occurred in the Wk4ÃƒÆ’Ã†â€™Ãƒâ€ Ã¢â‚¬â„¢ÃƒÆ’Ã¢â‚¬Â ÃƒÂ¢Ã¢â€šÂ¬Ã¢â€žÂ¢ÃƒÆ’Ã†â€™ÃƒÂ¢Ã¢â€šÂ¬Ã‚Â ÃƒÆ’Ã‚Â¢ÃƒÂ¢Ã¢â‚¬Å¡Ã‚Â¬ÃƒÂ¢Ã¢â‚¬Å¾Ã‚Â¢ÃƒÆ’Ã†â€™Ãƒâ€ Ã¢â‚¬â„¢ÃƒÆ’Ã‚Â¢ÃƒÂ¢Ã¢â‚¬Å¡Ã‚Â¬Ãƒâ€šÃ‚Â ÃƒÆ’Ã†â€™Ãƒâ€šÃ‚Â¢ÃƒÆ’Ã‚Â¢ÃƒÂ¢Ã¢â€šÂ¬Ã…Â¡Ãƒâ€šÃ‚Â¬ÃƒÆ’Ã‚Â¢ÃƒÂ¢Ã¢â€šÂ¬Ã…Â¾Ãƒâ€šÃ‚Â¢ÃƒÆ’Ã†â€™Ãƒâ€ Ã¢â‚¬â„¢ÃƒÆ’Ã¢â‚¬Â ÃƒÂ¢Ã¢â€šÂ¬Ã¢â€žÂ¢ÃƒÆ’Ã†â€™Ãƒâ€šÃ‚Â¢ÃƒÆ’Ã‚Â¢ÃƒÂ¢Ã¢â€šÂ¬Ã…Â¡Ãƒâ€šÃ‚Â¬ÃƒÆ’Ã¢â‚¬Å¡Ãƒâ€šÃ‚Â ÃƒÆ’Ã†â€™Ãƒâ€ Ã¢â‚¬â„¢ÃƒÆ’Ã¢â‚¬Å¡Ãƒâ€šÃ‚Â¢ÃƒÆ’Ã†â€™Ãƒâ€šÃ‚Â¢ÃƒÆ’Ã‚Â¢ÃƒÂ¢Ã¢â‚¬Å¡Ã‚Â¬Ãƒâ€¦Ã‚Â¡ÃƒÆ’Ã¢â‚¬Å¡Ãƒâ€šÃ‚Â¬ÃƒÆ’Ã†â€™Ãƒâ€šÃ‚Â¢ÃƒÆ’Ã‚Â¢ÃƒÂ¢Ã¢â‚¬Å¡Ã‚Â¬Ãƒâ€¦Ã‚Â¾ÃƒÆ’Ã¢â‚¬Å¡Ãƒâ€šÃ‚Â¢ÃƒÆ’Ã†â€™Ãƒâ€ Ã¢â‚¬â„¢ÃƒÆ’Ã¢â‚¬Â ÃƒÂ¢Ã¢â€šÂ¬Ã¢â€žÂ¢ÃƒÆ’Ã†â€™ÃƒÂ¢Ã¢â€šÂ¬Ã‚Â ÃƒÆ’Ã‚Â¢ÃƒÂ¢Ã¢â‚¬Å¡Ã‚Â¬ÃƒÂ¢Ã¢â‚¬Å¾Ã‚Â¢ÃƒÆ’Ã†â€™Ãƒâ€ Ã¢â‚¬â„¢ÃƒÆ’Ã¢â‚¬Å¡Ãƒâ€šÃ‚Â¢ÃƒÆ’Ã†â€™Ãƒâ€šÃ‚Â¢ÃƒÆ’Ã‚Â¢ÃƒÂ¢Ã¢â‚¬Å¡Ã‚Â¬Ãƒâ€¦Ã‚Â¡ÃƒÆ’Ã¢â‚¬Å¡Ãƒâ€šÃ‚Â¬ÃƒÆ’Ã†â€™ÃƒÂ¢Ã¢â€šÂ¬Ã‚Â¦ÃƒÆ’Ã¢â‚¬Å¡Ãƒâ€šÃ‚Â¡ÃƒÆ’Ã†â€™Ãƒâ€ Ã¢â‚¬â„¢ÃƒÆ’Ã¢â‚¬Â ÃƒÂ¢Ã¢â€šÂ¬Ã¢â€žÂ¢ÃƒÆ’Ã†â€™Ãƒâ€šÃ‚Â¢ÃƒÆ’Ã‚Â¢ÃƒÂ¢Ã¢â€šÂ¬Ã…Â¡Ãƒâ€šÃ‚Â¬ÃƒÆ’Ã¢â‚¬Â¦Ãƒâ€šÃ‚Â¡ÃƒÆ’Ã†â€™Ãƒâ€ Ã¢â‚¬â„¢ÃƒÆ’Ã‚Â¢ÃƒÂ¢Ã¢â‚¬Å¡Ã‚Â¬Ãƒâ€¦Ã‚Â¡ÃƒÆ’Ã†â€™ÃƒÂ¢Ã¢â€šÂ¬Ã…Â¡ÃƒÆ’Ã¢â‚¬Å¡Ãƒâ€šÃ‚Â¢ÃƒÆ’Ã†â€™Ãƒâ€ Ã¢â‚¬â„¢ÃƒÆ’Ã¢â‚¬Â ÃƒÂ¢Ã¢â€šÂ¬Ã¢â€žÂ¢ÃƒÆ’Ã†â€™ÃƒÂ¢Ã¢â€šÂ¬Ã‚Â ÃƒÆ’Ã‚Â¢ÃƒÂ¢Ã¢â‚¬Å¡Ã‚Â¬ÃƒÂ¢Ã¢â‚¬Å¾Ã‚Â¢ÃƒÆ’Ã†â€™Ãƒâ€ Ã¢â‚¬â„¢ÃƒÆ’Ã‚Â¢ÃƒÂ¢Ã¢â‚¬Å¡Ã‚Â¬Ãƒâ€šÃ‚Â ÃƒÆ’Ã†â€™Ãƒâ€šÃ‚Â¢ÃƒÆ’Ã‚Â¢ÃƒÂ¢Ã¢â€šÂ¬Ã…Â¡Ãƒâ€šÃ‚Â¬ÃƒÆ’Ã‚Â¢ÃƒÂ¢Ã¢â€šÂ¬Ã…Â¾Ãƒâ€šÃ‚Â¢ÃƒÆ’Ã†â€™Ãƒâ€ Ã¢â‚¬â„¢ÃƒÆ’Ã¢â‚¬Â ÃƒÂ¢Ã¢â€šÂ¬Ã¢â€žÂ¢ÃƒÆ’Ã†â€™Ãƒâ€šÃ‚Â¢ÃƒÆ’Ã‚Â¢ÃƒÂ¢Ã¢â€šÂ¬Ã…Â¡Ãƒâ€šÃ‚Â¬ÃƒÆ’Ã¢â‚¬Â¦Ãƒâ€šÃ‚Â¡ÃƒÆ’Ã†â€™Ãƒâ€ Ã¢â‚¬â„¢ÃƒÆ’Ã‚Â¢ÃƒÂ¢Ã¢â‚¬Å¡Ã‚Â¬Ãƒâ€¦Ã‚Â¡ÃƒÆ’Ã†â€™ÃƒÂ¢Ã¢â€šÂ¬Ã…Â¡ÃƒÆ’Ã¢â‚¬Å¡Ãƒâ€šÃ‚Â¢ÃƒÆ’Ã†â€™Ãƒâ€ Ã¢â‚¬â„¢ÃƒÆ’Ã¢â‚¬Â ÃƒÂ¢Ã¢â€šÂ¬Ã¢â€žÂ¢ÃƒÆ’Ã†â€™ÃƒÂ¢Ã¢â€šÂ¬Ã‚Â ÃƒÆ’Ã‚Â¢ÃƒÂ¢Ã¢â‚¬Å¡Ã‚Â¬ÃƒÂ¢Ã¢â‚¬Å¾Ã‚Â¢ÃƒÆ’Ã†â€™Ãƒâ€ Ã¢â‚¬â„¢ÃƒÆ’Ã‚Â¢ÃƒÂ¢Ã¢â‚¬Å¡Ã‚Â¬Ãƒâ€¦Ã‚Â¡ÃƒÆ’Ã†â€™ÃƒÂ¢Ã¢â€šÂ¬Ã…Â¡ÃƒÆ’Ã¢â‚¬Å¡Ãƒâ€šÃ‚Â¢ÃƒÆ’Ã†â€™Ãƒâ€ Ã¢â‚¬â„¢ÃƒÆ’Ã¢â‚¬Â ÃƒÂ¢Ã¢â€šÂ¬Ã¢â€žÂ¢ÃƒÆ’Ã†â€™ÃƒÂ¢Ã¢â€šÂ¬Ã…Â¡ÃƒÆ’Ã¢â‚¬Å¡Ãƒâ€šÃ‚Â¢ÃƒÆ’Ã†â€™Ãƒâ€ Ã¢â‚¬â„¢ÃƒÆ’Ã¢â‚¬Å¡Ãƒâ€šÃ‚Â¢ÃƒÆ’Ã†â€™Ãƒâ€šÃ‚Â¢ÃƒÆ’Ã‚Â¢ÃƒÂ¢Ã¢â‚¬Å¡Ã‚Â¬Ãƒâ€¦Ã‚Â¡ÃƒÆ’Ã¢â‚¬Å¡Ãƒâ€šÃ‚Â¬ÃƒÆ’Ã†â€™ÃƒÂ¢Ã¢â€šÂ¬Ã‚Â¦ÃƒÆ’Ã¢â‚¬Å¡Ãƒâ€šÃ‚Â¡ÃƒÆ’Ã†â€™Ãƒâ€ Ã¢â‚¬â„¢ÃƒÆ’Ã‚Â¢ÃƒÂ¢Ã¢â‚¬Å¡Ã‚Â¬Ãƒâ€¦Ã‚Â¡ÃƒÆ’Ã†â€™ÃƒÂ¢Ã¢â€šÂ¬Ã…Â¡ÃƒÆ’Ã¢â‚¬Å¡Ãƒâ€šÃ‚Â¬ÃƒÆ’Ã†â€™Ãƒâ€ Ã¢â‚¬â„¢ÃƒÆ’Ã¢â‚¬Â ÃƒÂ¢Ã¢â€šÂ¬Ã¢â€žÂ¢ÃƒÆ’Ã†â€™Ãƒâ€šÃ‚Â¢ÃƒÆ’Ã‚Â¢ÃƒÂ¢Ã¢â€šÂ¬Ã…Â¡Ãƒâ€šÃ‚Â¬ÃƒÆ’Ã¢â‚¬Å¡Ãƒâ€šÃ‚Â¦ÃƒÆ’Ã†â€™Ãƒâ€ Ã¢â‚¬â„¢ÃƒÆ’Ã‚Â¢ÃƒÂ¢Ã¢â‚¬Å¡Ã‚Â¬Ãƒâ€¦Ã‚Â¡ÃƒÆ’Ã†â€™ÃƒÂ¢Ã¢â€šÂ¬Ã…Â¡ÃƒÆ’Ã¢â‚¬Å¡Ãƒâ€šÃ‚Â¡ÃƒÆ’Ã†â€™Ãƒâ€ Ã¢â‚¬â„¢ÃƒÆ’Ã¢â‚¬Â ÃƒÂ¢Ã¢â€šÂ¬Ã¢â€žÂ¢ÃƒÆ’Ã†â€™ÃƒÂ¢Ã¢â€šÂ¬Ã‚Â ÃƒÆ’Ã‚Â¢ÃƒÂ¢Ã¢â‚¬Å¡Ã‚Â¬ÃƒÂ¢Ã¢â‚¬Å¾Ã‚Â¢ÃƒÆ’Ã†â€™Ãƒâ€ Ã¢â‚¬â„¢ÃƒÆ’Ã¢â‚¬Å¡Ãƒâ€šÃ‚Â¢ÃƒÆ’Ã†â€™Ãƒâ€šÃ‚Â¢ÃƒÆ’Ã‚Â¢ÃƒÂ¢Ã¢â‚¬Å¡Ã‚Â¬Ãƒâ€¦Ã‚Â¡ÃƒÆ’Ã¢â‚¬Å¡Ãƒâ€šÃ‚Â¬ÃƒÆ’Ã†â€™ÃƒÂ¢Ã¢â€šÂ¬Ã‚Â¦ÃƒÆ’Ã¢â‚¬Å¡Ãƒâ€šÃ‚Â¡ÃƒÆ’Ã†â€™Ãƒâ€ Ã¢â‚¬â„¢ÃƒÆ’Ã¢â‚¬Â ÃƒÂ¢Ã¢â€šÂ¬Ã¢â€žÂ¢ÃƒÆ’Ã†â€™Ãƒâ€šÃ‚Â¢ÃƒÆ’Ã‚Â¢ÃƒÂ¢Ã¢â€šÂ¬Ã…Â¡Ãƒâ€šÃ‚Â¬ÃƒÆ’Ã¢â‚¬Â¦Ãƒâ€šÃ‚Â¡ÃƒÆ’Ã†â€™Ãƒâ€ Ã¢â‚¬â„¢ÃƒÆ’Ã‚Â¢ÃƒÂ¢Ã¢â‚¬Å¡Ã‚Â¬Ãƒâ€¦Ã‚Â¡ÃƒÆ’Ã†â€™ÃƒÂ¢Ã¢â€šÂ¬Ã…Â¡ÃƒÆ’Ã¢â‚¬Å¡Ãƒâ€šÃ‚Â¬ÃƒÆ’Ã†â€™Ãƒâ€ Ã¢â‚¬â„¢ÃƒÆ’Ã¢â‚¬Â ÃƒÂ¢Ã¢â€šÂ¬Ã¢â€žÂ¢ÃƒÆ’Ã†â€™ÃƒÂ¢Ã¢â€šÂ¬Ã‚Â ÃƒÆ’Ã‚Â¢ÃƒÂ¢Ã¢â‚¬Å¡Ã‚Â¬ÃƒÂ¢Ã¢â‚¬Å¾Ã‚Â¢ÃƒÆ’Ã†â€™Ãƒâ€ Ã¢â‚¬â„¢ÃƒÆ’Ã‚Â¢ÃƒÂ¢Ã¢â‚¬Å¡Ã‚Â¬Ãƒâ€šÃ‚Â ÃƒÆ’Ã†â€™Ãƒâ€šÃ‚Â¢ÃƒÆ’Ã‚Â¢ÃƒÂ¢Ã¢â€šÂ¬Ã…Â¡Ãƒâ€šÃ‚Â¬ÃƒÆ’Ã‚Â¢ÃƒÂ¢Ã¢â€šÂ¬Ã…Â¾Ãƒâ€šÃ‚Â¢ÃƒÆ’Ã†â€™Ãƒâ€ Ã¢â‚¬â„¢ÃƒÆ’Ã¢â‚¬Â ÃƒÂ¢Ã¢â€šÂ¬Ã¢â€žÂ¢ÃƒÆ’Ã†â€™Ãƒâ€šÃ‚Â¢ÃƒÆ’Ã‚Â¢ÃƒÂ¢Ã¢â€šÂ¬Ã…Â¡Ãƒâ€šÃ‚Â¬ÃƒÆ’Ã¢â‚¬Â¦Ãƒâ€šÃ‚Â¡ÃƒÆ’Ã†â€™Ãƒâ€ Ã¢â‚¬â„¢ÃƒÆ’Ã‚Â¢ÃƒÂ¢Ã¢â‚¬Å¡Ã‚Â¬Ãƒâ€¦Ã‚Â¡ÃƒÆ’Ã†â€™ÃƒÂ¢Ã¢â€šÂ¬Ã…Â¡ÃƒÆ’Ã¢â‚¬Å¡Ãƒâ€šÃ‚Â¢ÃƒÆ’Ã†â€™Ãƒâ€ Ã¢â‚¬â„¢ÃƒÆ’Ã¢â‚¬Â ÃƒÂ¢Ã¢â€šÂ¬Ã¢â€žÂ¢ÃƒÆ’Ã†â€™ÃƒÂ¢Ã¢â€šÂ¬Ã‚Â ÃƒÆ’Ã‚Â¢ÃƒÂ¢Ã¢â‚¬Å¡Ã‚Â¬ÃƒÂ¢Ã¢â‚¬Å¾Ã‚Â¢ÃƒÆ’Ã†â€™Ãƒâ€ Ã¢â‚¬â„¢ÃƒÆ’Ã‚Â¢ÃƒÂ¢Ã¢â‚¬Å¡Ã‚Â¬Ãƒâ€¦Ã‚Â¡ÃƒÆ’Ã†â€™ÃƒÂ¢Ã¢â€šÂ¬Ã…Â¡ÃƒÆ’Ã¢â‚¬Å¡Ãƒâ€šÃ‚Â¢ÃƒÆ’Ã†â€™Ãƒâ€ Ã¢â‚¬â„¢ÃƒÆ’Ã¢â‚¬Â ÃƒÂ¢Ã¢â€šÂ¬Ã¢â€žÂ¢ÃƒÆ’Ã†â€™ÃƒÂ¢Ã¢â€šÂ¬Ã…Â¡ÃƒÆ’Ã¢â‚¬Å¡Ãƒâ€šÃ‚Â¢ÃƒÆ’Ã†â€™Ãƒâ€ Ã¢â‚¬â„¢ÃƒÆ’Ã¢â‚¬Å¡Ãƒâ€šÃ‚Â¢ÃƒÆ’Ã†â€™Ãƒâ€šÃ‚Â¢ÃƒÆ’Ã‚Â¢ÃƒÂ¢Ã¢â€šÂ¬Ã…Â¡Ãƒâ€šÃ‚Â¬ÃƒÆ’Ã¢â‚¬Â¦Ãƒâ€šÃ‚Â¡ÃƒÆ’Ã†â€™ÃƒÂ¢Ã¢â€šÂ¬Ã…Â¡ÃƒÆ’Ã¢â‚¬Å¡Ãƒâ€šÃ‚Â¬ÃƒÆ’Ã†â€™Ãƒâ€ Ã¢â‚¬â„¢ÃƒÆ’Ã‚Â¢ÃƒÂ¢Ã¢â‚¬Å¡Ã‚Â¬Ãƒâ€šÃ‚Â¦ÃƒÆ’Ã†â€™ÃƒÂ¢Ã¢â€šÂ¬Ã…Â¡ÃƒÆ’Ã¢â‚¬Å¡Ãƒâ€šÃ‚Â¡ÃƒÆ’Ã†â€™Ãƒâ€ Ã¢â‚¬â„¢ÃƒÆ’Ã¢â‚¬Â ÃƒÂ¢Ã¢â€šÂ¬Ã¢â€žÂ¢ÃƒÆ’Ã†â€™Ãƒâ€šÃ‚Â¢ÃƒÆ’Ã‚Â¢ÃƒÂ¢Ã¢â€šÂ¬Ã…Â¡Ãƒâ€šÃ‚Â¬ÃƒÆ’Ã¢â‚¬Â¦Ãƒâ€šÃ‚Â¡ÃƒÆ’Ã†â€™Ãƒâ€ Ã¢â‚¬â„¢ÃƒÆ’Ã‚Â¢ÃƒÂ¢Ã¢â‚¬Å¡Ã‚Â¬Ãƒâ€¦Ã‚Â¡ÃƒÆ’Ã†â€™ÃƒÂ¢Ã¢â€šÂ¬Ã…Â¡ÃƒÆ’Ã¢â‚¬Å¡Ãƒâ€šÃ‚Â¬ÃƒÆ’Ã†â€™Ãƒâ€ Ã¢â‚¬â„¢ÃƒÆ’Ã¢â‚¬Â ÃƒÂ¢Ã¢â€šÂ¬Ã¢â€žÂ¢ÃƒÆ’Ã†â€™ÃƒÂ¢Ã¢â€šÂ¬Ã‚Â ÃƒÆ’Ã‚Â¢ÃƒÂ¢Ã¢â‚¬Å¡Ã‚Â¬ÃƒÂ¢Ã¢â‚¬Å¾Ã‚Â¢ÃƒÆ’Ã†â€™Ãƒâ€ Ã¢â‚¬â„¢ÃƒÆ’Ã¢â‚¬Å¡Ãƒâ€šÃ‚Â¢ÃƒÆ’Ã†â€™Ãƒâ€šÃ‚Â¢ÃƒÆ’Ã‚Â¢ÃƒÂ¢Ã¢â‚¬Å¡Ã‚Â¬Ãƒâ€¦Ã‚Â¡ÃƒÆ’Ã¢â‚¬Å¡Ãƒâ€šÃ‚Â¬ÃƒÆ’Ã†â€™ÃƒÂ¢Ã¢â€šÂ¬Ã…Â¡ÃƒÆ’Ã¢â‚¬Å¡Ãƒâ€šÃ‚Â¦ÃƒÆ’Ã†â€™Ãƒâ€ Ã¢â‚¬â„¢ÃƒÆ’Ã¢â‚¬Â ÃƒÂ¢Ã¢â€šÂ¬Ã¢â€žÂ¢ÃƒÆ’Ã†â€™ÃƒÂ¢Ã¢â€šÂ¬Ã…Â¡ÃƒÆ’Ã¢â‚¬Å¡Ãƒâ€šÃ‚Â¢ÃƒÆ’Ã†â€™Ãƒâ€ Ã¢â‚¬â„¢ÃƒÆ’Ã¢â‚¬Å¡Ãƒâ€šÃ‚Â¢ÃƒÆ’Ã†â€™Ãƒâ€šÃ‚Â¢ÃƒÆ’Ã‚Â¢ÃƒÂ¢Ã¢â€šÂ¬Ã…Â¡Ãƒâ€šÃ‚Â¬ÃƒÆ’Ã¢â‚¬Â¦Ãƒâ€šÃ‚Â¡ÃƒÆ’Ã†â€™ÃƒÂ¢Ã¢â€šÂ¬Ã…Â¡ÃƒÆ’Ã¢â‚¬Å¡Ãƒâ€šÃ‚Â¬ÃƒÆ’Ã†â€™Ãƒâ€ Ã¢â‚¬â„¢ÃƒÆ’Ã‚Â¢ÃƒÂ¢Ã¢â‚¬Å¡Ã‚Â¬Ãƒâ€šÃ‚Â¦ÃƒÆ’Ã†â€™Ãƒâ€šÃ‚Â¢ÃƒÆ’Ã‚Â¢ÃƒÂ¢Ã¢â€šÂ¬Ã…Â¡Ãƒâ€šÃ‚Â¬ÃƒÆ’Ã¢â‚¬Â¦ÃƒÂ¢Ã¢â€šÂ¬Ã…â€œWk5 interval, where the Monoculture system showed a severe drop in growth (-27.608 g/day), while the IMTA system only recorded a minor decline (-2.266 g/day), indicating greater stability in the IMTA setup. In the final interval (Wk5ÃƒÆ’Ã†â€™Ãƒâ€ Ã¢â‚¬â„¢ÃƒÆ’Ã¢â‚¬Â ÃƒÂ¢Ã¢â€šÂ¬Ã¢â€žÂ¢ÃƒÆ’Ã†â€™ÃƒÂ¢Ã¢â€šÂ¬Ã‚Â ÃƒÆ’Ã‚Â¢ÃƒÂ¢Ã¢â‚¬Å¡Ã‚Â¬ÃƒÂ¢Ã¢â‚¬Å¾Ã‚Â¢ÃƒÆ’Ã†â€™Ãƒâ€ Ã¢â‚¬â„¢ÃƒÆ’Ã‚Â¢ÃƒÂ¢Ã¢â‚¬Å¡Ã‚Â¬Ãƒâ€šÃ‚Â ÃƒÆ’Ã†â€™Ãƒâ€šÃ‚Â¢ÃƒÆ’Ã‚Â¢ÃƒÂ¢Ã¢â€šÂ¬Ã…Â¡Ãƒâ€šÃ‚Â¬ÃƒÆ’Ã‚Â¢ÃƒÂ¢Ã¢â€šÂ¬Ã…Â¾Ãƒâ€šÃ‚Â¢ÃƒÆ’Ã†â€™Ãƒâ€ Ã¢â‚¬â„¢ÃƒÆ’Ã¢â‚¬Â ÃƒÂ¢Ã¢â€šÂ¬Ã¢â€žÂ¢ÃƒÆ’Ã†â€™Ãƒâ€šÃ‚Â¢ÃƒÆ’Ã‚Â¢ÃƒÂ¢Ã¢â€šÂ¬Ã…Â¡Ãƒâ€šÃ‚Â¬ÃƒÆ’Ã¢â‚¬Å¡Ãƒâ€šÃ‚Â ÃƒÆ’Ã†â€™Ãƒâ€ Ã¢â‚¬â„¢ÃƒÆ’Ã¢â‚¬Å¡Ãƒâ€šÃ‚Â¢ÃƒÆ’Ã†â€™Ãƒâ€šÃ‚Â¢ÃƒÆ’Ã‚Â¢ÃƒÂ¢Ã¢â‚¬Å¡Ã‚Â¬Ãƒâ€¦Ã‚Â¡ÃƒÆ’Ã¢â‚¬Å¡Ãƒâ€šÃ‚Â¬ÃƒÆ’Ã†â€™Ãƒâ€šÃ‚Â¢ÃƒÆ’Ã‚Â¢ÃƒÂ¢Ã¢â‚¬Å¡Ã‚Â¬Ãƒâ€¦Ã‚Â¾ÃƒÆ’Ã¢â‚¬Å¡Ãƒâ€šÃ‚Â¢ÃƒÆ’Ã†â€™Ãƒâ€ Ã¢â‚¬â„¢ÃƒÆ’Ã¢â‚¬Â ÃƒÂ¢Ã¢â€šÂ¬Ã¢â€žÂ¢ÃƒÆ’Ã†â€™ÃƒÂ¢Ã¢â€šÂ¬Ã‚Â ÃƒÆ’Ã‚Â¢ÃƒÂ¢Ã¢â‚¬Å¡Ã‚Â¬ÃƒÂ¢Ã¢â‚¬Å¾Ã‚Â¢ÃƒÆ’Ã†â€™Ãƒâ€ Ã¢â‚¬â„¢ÃƒÆ’Ã¢â‚¬Å¡Ãƒâ€šÃ‚Â¢ÃƒÆ’Ã†â€™Ãƒâ€šÃ‚Â¢ÃƒÆ’Ã‚Â¢ÃƒÂ¢Ã¢â‚¬Å¡Ã‚Â¬Ãƒâ€¦Ã‚Â¡ÃƒÆ’Ã¢â‚¬Å¡Ãƒâ€šÃ‚Â¬ÃƒÆ’Ã†â€™ÃƒÂ¢Ã¢â€šÂ¬Ã‚Â¦ÃƒÆ’Ã¢â‚¬Å¡Ãƒâ€šÃ‚Â¡ÃƒÆ’Ã†â€™Ãƒâ€ Ã¢â‚¬â„¢ÃƒÆ’Ã¢â‚¬Â ÃƒÂ¢Ã¢â€šÂ¬Ã¢â€žÂ¢ÃƒÆ’Ã†â€™Ãƒâ€šÃ‚Â¢ÃƒÆ’Ã‚Â¢ÃƒÂ¢Ã¢â€šÂ¬Ã…Â¡Ãƒâ€šÃ‚Â¬ÃƒÆ’Ã¢â‚¬Â¦Ãƒâ€šÃ‚Â¡ÃƒÆ’Ã†â€™Ãƒâ€ Ã¢â‚¬â„¢ÃƒÆ’Ã‚Â¢ÃƒÂ¢Ã¢â‚¬Å¡Ã‚Â¬Ãƒâ€¦Ã‚Â¡ÃƒÆ’Ã†â€™ÃƒÂ¢Ã¢â€šÂ¬Ã…Â¡ÃƒÆ’Ã¢â‚¬Å¡Ãƒâ€šÃ‚Â¢ÃƒÆ’Ã†â€™Ãƒâ€ Ã¢â‚¬â„¢ÃƒÆ’Ã¢â‚¬Â ÃƒÂ¢Ã¢â€šÂ¬Ã¢â€žÂ¢ÃƒÆ’Ã†â€™ÃƒÂ¢Ã¢â€šÂ¬Ã‚Â ÃƒÆ’Ã‚Â¢ÃƒÂ¢Ã¢â‚¬Å¡Ã‚Â¬ÃƒÂ¢Ã¢â‚¬Å¾Ã‚Â¢ÃƒÆ’Ã†â€™Ãƒâ€ Ã¢â‚¬â„¢ÃƒÆ’Ã‚Â¢ÃƒÂ¢Ã¢â‚¬Å¡Ã‚Â¬Ãƒâ€šÃ‚Â ÃƒÆ’Ã†â€™Ãƒâ€šÃ‚Â¢ÃƒÆ’Ã‚Â¢ÃƒÂ¢Ã¢â€šÂ¬Ã…Â¡Ãƒâ€šÃ‚Â¬ÃƒÆ’Ã‚Â¢ÃƒÂ¢Ã¢â€šÂ¬Ã…Â¾Ãƒâ€šÃ‚Â¢ÃƒÆ’Ã†â€™Ãƒâ€ Ã¢â‚¬â„¢ÃƒÆ’Ã¢â‚¬Â ÃƒÂ¢Ã¢â€šÂ¬Ã¢â€žÂ¢ÃƒÆ’Ã†â€™Ãƒâ€šÃ‚Â¢ÃƒÆ’Ã‚Â¢ÃƒÂ¢Ã¢â€šÂ¬Ã…Â¡Ãƒâ€šÃ‚Â¬ÃƒÆ’Ã¢â‚¬Â¦Ãƒâ€šÃ‚Â¡ÃƒÆ’Ã†â€™Ãƒâ€ Ã¢â‚¬â„¢ÃƒÆ’Ã‚Â¢ÃƒÂ¢Ã¢â‚¬Å¡Ã‚Â¬Ãƒâ€¦Ã‚Â¡ÃƒÆ’Ã†â€™ÃƒÂ¢Ã¢â€šÂ¬Ã…Â¡ÃƒÆ’Ã¢â‚¬Å¡Ãƒâ€šÃ‚Â¢ÃƒÆ’Ã†â€™Ãƒâ€ Ã¢â‚¬â„¢ÃƒÆ’Ã¢â‚¬Â ÃƒÂ¢Ã¢â€šÂ¬Ã¢â€žÂ¢ÃƒÆ’Ã†â€™ÃƒÂ¢Ã¢â€šÂ¬Ã‚Â ÃƒÆ’Ã‚Â¢ÃƒÂ¢Ã¢â‚¬Å¡Ã‚Â¬ÃƒÂ¢Ã¢â‚¬Å¾Ã‚Â¢ÃƒÆ’Ã†â€™Ãƒâ€ Ã¢â‚¬â„¢ÃƒÆ’Ã‚Â¢ÃƒÂ¢Ã¢â‚¬Å¡Ã‚Â¬Ãƒâ€¦Ã‚Â¡ÃƒÆ’Ã†â€™ÃƒÂ¢Ã¢â€šÂ¬Ã…Â¡ÃƒÆ’Ã¢â‚¬Å¡Ãƒâ€šÃ‚Â¢ÃƒÆ’Ã†â€™Ãƒâ€ Ã¢â‚¬â„¢ÃƒÆ’Ã¢â‚¬Â ÃƒÂ¢Ã¢â€šÂ¬Ã¢â€žÂ¢ÃƒÆ’Ã†â€™ÃƒÂ¢Ã¢â€šÂ¬Ã…Â¡ÃƒÆ’Ã¢â‚¬Å¡Ãƒâ€šÃ‚Â¢ÃƒÆ’Ã†â€™Ãƒâ€ Ã¢â‚¬â„¢ÃƒÆ’Ã¢â‚¬Å¡Ãƒâ€šÃ‚Â¢ÃƒÆ’Ã†â€™Ãƒâ€šÃ‚Â¢ÃƒÆ’Ã‚Â¢ÃƒÂ¢Ã¢â‚¬Å¡Ã‚Â¬Ãƒâ€¦Ã‚Â¡ÃƒÆ’Ã¢â‚¬Å¡Ãƒâ€šÃ‚Â¬ÃƒÆ’Ã†â€™ÃƒÂ¢Ã¢â€šÂ¬Ã‚Â¦ÃƒÆ’Ã¢â‚¬Å¡Ãƒâ€šÃ‚Â¡ÃƒÆ’Ã†â€™Ãƒâ€ Ã¢â‚¬â„¢ÃƒÆ’Ã‚Â¢ÃƒÂ¢Ã¢â‚¬Å¡Ã‚Â¬Ãƒâ€¦Ã‚Â¡ÃƒÆ’Ã†â€™ÃƒÂ¢Ã¢â€šÂ¬Ã…Â¡ÃƒÆ’Ã¢â‚¬Å¡Ãƒâ€šÃ‚Â¬ÃƒÆ’Ã†â€™Ãƒâ€ Ã¢â‚¬â„¢ÃƒÆ’Ã¢â‚¬Â ÃƒÂ¢Ã¢â€šÂ¬Ã¢â€žÂ¢ÃƒÆ’Ã†â€™Ãƒâ€šÃ‚Â¢ÃƒÆ’Ã‚Â¢ÃƒÂ¢Ã¢â€šÂ¬Ã…Â¡Ãƒâ€šÃ‚Â¬ÃƒÆ’Ã¢â‚¬Å¡Ãƒâ€šÃ‚Â¦ÃƒÆ’Ã†â€™Ãƒâ€ Ã¢â‚¬â„¢ÃƒÆ’Ã‚Â¢ÃƒÂ¢Ã¢â‚¬Å¡Ã‚Â¬Ãƒâ€¦Ã‚Â¡ÃƒÆ’Ã†â€™ÃƒÂ¢Ã¢â€šÂ¬Ã…Â¡ÃƒÆ’Ã¢â‚¬Å¡Ãƒâ€šÃ‚Â¡ÃƒÆ’Ã†â€™Ãƒâ€ Ã¢â‚¬â„¢ÃƒÆ’Ã¢â‚¬Â ÃƒÂ¢Ã¢â€šÂ¬Ã¢â€žÂ¢ÃƒÆ’Ã†â€™ÃƒÂ¢Ã¢â€šÂ¬Ã‚Â ÃƒÆ’Ã‚Â¢ÃƒÂ¢Ã¢â‚¬Å¡Ã‚Â¬ÃƒÂ¢Ã¢â‚¬Å¾Ã‚Â¢ÃƒÆ’Ã†â€™Ãƒâ€ Ã¢â‚¬â„¢ÃƒÆ’Ã¢â‚¬Å¡Ãƒâ€šÃ‚Â¢ÃƒÆ’Ã†â€™Ãƒâ€šÃ‚Â¢ÃƒÆ’Ã‚Â¢ÃƒÂ¢Ã¢â‚¬Å¡Ã‚Â¬Ãƒâ€¦Ã‚Â¡ÃƒÆ’Ã¢â‚¬Å¡Ãƒâ€šÃ‚Â¬ÃƒÆ’Ã†â€™ÃƒÂ¢Ã¢â€šÂ¬Ã‚Â¦ÃƒÆ’Ã¢â‚¬Å¡Ãƒâ€šÃ‚Â¡ÃƒÆ’Ã†â€™Ãƒâ€ Ã¢â‚¬â„¢ÃƒÆ’Ã¢â‚¬Â ÃƒÂ¢Ã¢â€šÂ¬Ã¢â€žÂ¢ÃƒÆ’Ã†â€™Ãƒâ€šÃ‚Â¢ÃƒÆ’Ã‚Â¢ÃƒÂ¢Ã¢â€šÂ¬Ã…Â¡Ãƒâ€šÃ‚Â¬ÃƒÆ’Ã¢â‚¬Â¦Ãƒâ€šÃ‚Â¡ÃƒÆ’Ã†â€™Ãƒâ€ Ã¢â‚¬â„¢ÃƒÆ’Ã‚Â¢ÃƒÂ¢Ã¢â‚¬Å¡Ã‚Â¬Ãƒâ€¦Ã‚Â¡ÃƒÆ’Ã†â€™ÃƒÂ¢Ã¢â€šÂ¬Ã…Â¡ÃƒÆ’Ã¢â‚¬Å¡Ãƒâ€šÃ‚Â¬ÃƒÆ’Ã†â€™Ãƒâ€ Ã¢â‚¬â„¢ÃƒÆ’Ã¢â‚¬Â ÃƒÂ¢Ã¢â€šÂ¬Ã¢â€žÂ¢ÃƒÆ’Ã†â€™ÃƒÂ¢Ã¢â€šÂ¬Ã‚Â ÃƒÆ’Ã‚Â¢ÃƒÂ¢Ã¢â‚¬Å¡Ã‚Â¬ÃƒÂ¢Ã¢â‚¬Å¾Ã‚Â¢ÃƒÆ’Ã†â€™Ãƒâ€ Ã¢â‚¬â„¢ÃƒÆ’Ã‚Â¢ÃƒÂ¢Ã¢â‚¬Å¡Ã‚Â¬Ãƒâ€šÃ‚Â ÃƒÆ’Ã†â€™Ãƒâ€šÃ‚Â¢ÃƒÆ’Ã‚Â¢ÃƒÂ¢Ã¢â€šÂ¬Ã…Â¡Ãƒâ€šÃ‚Â¬ÃƒÆ’Ã‚Â¢ÃƒÂ¢Ã¢â€šÂ¬Ã…Â¾Ãƒâ€šÃ‚Â¢ÃƒÆ’Ã†â€™Ãƒâ€ Ã¢â‚¬â„¢ÃƒÆ’Ã¢â‚¬Â ÃƒÂ¢Ã¢â€šÂ¬Ã¢â€žÂ¢ÃƒÆ’Ã†â€™Ãƒâ€šÃ‚Â¢ÃƒÆ’Ã‚Â¢ÃƒÂ¢Ã¢â€šÂ¬Ã…Â¡Ãƒâ€šÃ‚Â¬ÃƒÆ’Ã¢â‚¬Â¦Ãƒâ€šÃ‚Â¡ÃƒÆ’Ã†â€™Ãƒâ€ Ã¢â‚¬â„¢ÃƒÆ’Ã‚Â¢ÃƒÂ¢Ã¢â‚¬Å¡Ã‚Â¬Ãƒâ€¦Ã‚Â¡ÃƒÆ’Ã†â€™ÃƒÂ¢Ã¢â€šÂ¬Ã…Â¡ÃƒÆ’Ã¢â‚¬Å¡Ãƒâ€šÃ‚Â¢ÃƒÆ’Ã†â€™Ãƒâ€ Ã¢â‚¬â„¢ÃƒÆ’Ã¢â‚¬Â ÃƒÂ¢Ã¢â€šÂ¬Ã¢â€žÂ¢ÃƒÆ’Ã†â€™ÃƒÂ¢Ã¢â€šÂ¬Ã‚Â ÃƒÆ’Ã‚Â¢ÃƒÂ¢Ã¢â‚¬Å¡Ã‚Â¬ÃƒÂ¢Ã¢â‚¬Å¾Ã‚Â¢ÃƒÆ’Ã†â€™Ãƒâ€ Ã¢â‚¬â„¢ÃƒÆ’Ã‚Â¢ÃƒÂ¢Ã¢â‚¬Å¡Ã‚Â¬Ãƒâ€¦Ã‚Â¡ÃƒÆ’Ã†â€™ÃƒÂ¢Ã¢â€šÂ¬Ã…Â¡ÃƒÆ’Ã¢â‚¬Å¡Ãƒâ€šÃ‚Â¢ÃƒÆ’Ã†â€™Ãƒâ€ Ã¢â‚¬â„¢ÃƒÆ’Ã¢â‚¬Â ÃƒÂ¢Ã¢â€šÂ¬Ã¢â€žÂ¢ÃƒÆ’Ã†â€™ÃƒÂ¢Ã¢â€šÂ¬Ã…Â¡ÃƒÆ’Ã¢â‚¬Å¡Ãƒâ€šÃ‚Â¢ÃƒÆ’Ã†â€™Ãƒâ€ Ã¢â‚¬â„¢ÃƒÆ’Ã¢â‚¬Å¡Ãƒâ€šÃ‚Â¢ÃƒÆ’Ã†â€™Ãƒâ€šÃ‚Â¢ÃƒÆ’Ã‚Â¢ÃƒÂ¢Ã¢â€šÂ¬Ã…Â¡Ãƒâ€šÃ‚Â¬ÃƒÆ’Ã¢â‚¬Â¦Ãƒâ€šÃ‚Â¡ÃƒÆ’Ã†â€™ÃƒÂ¢Ã¢â€šÂ¬Ã…Â¡ÃƒÆ’Ã¢â‚¬Å¡Ãƒâ€šÃ‚Â¬ÃƒÆ’Ã†â€™Ãƒâ€ Ã¢â‚¬â„¢ÃƒÆ’Ã‚Â¢ÃƒÂ¢Ã¢â‚¬Å¡Ã‚Â¬Ãƒâ€šÃ‚Â¦ÃƒÆ’Ã†â€™ÃƒÂ¢Ã¢â€šÂ¬Ã…Â¡ÃƒÆ’Ã¢â‚¬Å¡Ãƒâ€šÃ‚Â¡ÃƒÆ’Ã†â€™Ãƒâ€ Ã¢â‚¬â„¢ÃƒÆ’Ã¢â‚¬Â ÃƒÂ¢Ã¢â€šÂ¬Ã¢â€žÂ¢ÃƒÆ’Ã†â€™Ãƒâ€šÃ‚Â¢ÃƒÆ’Ã‚Â¢ÃƒÂ¢Ã¢â€šÂ¬Ã…Â¡Ãƒâ€šÃ‚Â¬ÃƒÆ’Ã¢â‚¬Â¦Ãƒâ€šÃ‚Â¡ÃƒÆ’Ã†â€™Ãƒâ€ Ã¢â‚¬â„¢ÃƒÆ’Ã‚Â¢ÃƒÂ¢Ã¢â‚¬Å¡Ã‚Â¬Ãƒâ€¦Ã‚Â¡ÃƒÆ’Ã†â€™ÃƒÂ¢Ã¢â€šÂ¬Ã…Â¡ÃƒÆ’Ã¢â‚¬Å¡Ãƒâ€šÃ‚Â¬ÃƒÆ’Ã†â€™Ãƒâ€ Ã¢â‚¬â„¢ÃƒÆ’Ã¢â‚¬Â ÃƒÂ¢Ã¢â€šÂ¬Ã¢â€žÂ¢ÃƒÆ’Ã†â€™ÃƒÂ¢Ã¢â€šÂ¬Ã‚Â ÃƒÆ’Ã‚Â¢ÃƒÂ¢Ã¢â‚¬Å¡Ã‚Â¬ÃƒÂ¢Ã¢â‚¬Å¾Ã‚Â¢ÃƒÆ’Ã†â€™Ãƒâ€ Ã¢â‚¬â„¢ÃƒÆ’Ã¢â‚¬Å¡Ãƒâ€šÃ‚Â¢ÃƒÆ’Ã†â€™Ãƒâ€šÃ‚Â¢ÃƒÆ’Ã‚Â¢ÃƒÂ¢Ã¢â‚¬Å¡Ã‚Â¬Ãƒâ€¦Ã‚Â¡ÃƒÆ’Ã¢â‚¬Å¡Ãƒâ€šÃ‚Â¬ÃƒÆ’Ã†â€™ÃƒÂ¢Ã¢â€šÂ¬Ã…Â¡ÃƒÆ’Ã¢â‚¬Å¡Ãƒâ€šÃ‚Â¦ÃƒÆ’Ã†â€™Ãƒâ€ Ã¢â‚¬â„¢ÃƒÆ’Ã¢â‚¬Â ÃƒÂ¢Ã¢â€šÂ¬Ã¢â€žÂ¢ÃƒÆ’Ã†â€™ÃƒÂ¢Ã¢â€šÂ¬Ã…Â¡ÃƒÆ’Ã¢â‚¬Å¡Ãƒâ€šÃ‚Â¢ÃƒÆ’Ã†â€™Ãƒâ€ Ã¢â‚¬â„¢ÃƒÆ’Ã¢â‚¬Å¡Ãƒâ€šÃ‚Â¢ÃƒÆ’Ã†â€™Ãƒâ€šÃ‚Â¢ÃƒÆ’Ã‚Â¢ÃƒÂ¢Ã¢â€šÂ¬Ã…Â¡Ãƒâ€šÃ‚Â¬ÃƒÆ’Ã¢â‚¬Â¦Ãƒâ€šÃ‚Â¡ÃƒÆ’Ã†â€™ÃƒÂ¢Ã¢â€šÂ¬Ã…Â¡ÃƒÆ’Ã¢â‚¬Å¡Ãƒâ€šÃ‚Â¬ÃƒÆ’Ã†â€™Ãƒâ€ Ã¢â‚¬â„¢ÃƒÆ’Ã‚Â¢ÃƒÂ¢Ã¢â‚¬Å¡Ã‚Â¬Ãƒâ€šÃ‚Â¦ÃƒÆ’Ã†â€™Ãƒâ€šÃ‚Â¢ÃƒÆ’Ã‚Â¢ÃƒÂ¢Ã¢â€šÂ¬Ã…Â¡Ãƒâ€šÃ‚Â¬ÃƒÆ’Ã¢â‚¬Â¦ÃƒÂ¢Ã¢â€šÂ¬Ã…â€œWk6), both systems recovered again, with Monoculture reaching the highest AGR (13.854 g/day) and IMTA recording 8.307 g/day. Overall, although the Monoculture system achieved higher peak growth rates, the IMTA system demonstrated more stable and consistent growth performance, </w:t>
       </w:r>
       <w:r>
         <w:rPr>
@@ -2466,21 +2466,21 @@
         <w:rPr>
           <w:rFonts w:ascii="Times New Roman" w:hAnsi="Times New Roman" w:cs="Times New Roman"/>
         </w:rPr>
-        <w:t xml:space="preserve"> (%/day) in IMTA and Monoculture systems across four sampling intervals. Overall, both treatments show fluctuating growth patterns, including phases of weight loss and recovery. During the initial adaptation phase (Wk2ÃƒÆ’Ã†â€™Ãƒâ€ Ã¢â‚¬â„¢ÃƒÆ’Ã¢â‚¬Â ÃƒÂ¢Ã¢â€šÂ¬Ã¢â€žÂ¢ÃƒÆ’Ã†â€™ÃƒÂ¢Ã¢â€šÂ¬Ã‚Â ÃƒÆ’Ã‚Â¢ÃƒÂ¢Ã¢â‚¬Å¡Ã‚Â¬ÃƒÂ¢Ã¢â‚¬Å¾Ã‚Â¢ÃƒÆ’Ã†â€™Ãƒâ€ Ã¢â‚¬â„¢ÃƒÆ’Ã‚Â¢ÃƒÂ¢Ã¢â‚¬Å¡Ã‚Â¬Ãƒâ€¦Ã‚Â¡ÃƒÆ’Ã†â€™ÃƒÂ¢Ã¢â€šÂ¬Ã…Â¡ÃƒÆ’Ã¢â‚¬Å¡Ãƒâ€šÃ‚Â¢ÃƒÆ’Ã†â€™Ãƒâ€ Ã¢â‚¬â„¢ÃƒÆ’Ã¢â‚¬Â ÃƒÂ¢Ã¢â€šÂ¬Ã¢â€žÂ¢ÃƒÆ’Ã†â€™ÃƒÂ¢Ã¢â€šÂ¬Ã…Â¡ÃƒÆ’Ã¢â‚¬Å¡Ãƒâ€šÃ‚Â¢ÃƒÆ’Ã†â€™Ãƒâ€ Ã¢â‚¬â„¢ÃƒÆ’Ã¢â‚¬Å¡Ãƒâ€šÃ‚Â¢ÃƒÆ’Ã†â€™Ãƒâ€šÃ‚Â¢ÃƒÆ’Ã‚Â¢ÃƒÂ¢Ã¢â‚¬Å¡Ã‚Â¬Ãƒâ€¦Ã‚Â¡ÃƒÆ’Ã¢â‚¬Å¡Ãƒâ€šÃ‚Â¬ÃƒÆ’Ã†â€™ÃƒÂ¢Ã¢â€šÂ¬Ã‚Â¦ÃƒÆ’Ã¢â‚¬Å¡Ãƒâ€šÃ‚Â¡ÃƒÆ’Ã†â€™Ãƒâ€ Ã¢â‚¬â„¢ÃƒÆ’Ã‚Â¢ÃƒÂ¢Ã¢â‚¬Å¡Ã‚Â¬Ãƒâ€¦Ã‚Â¡ÃƒÆ’Ã†â€™ÃƒÂ¢Ã¢â€šÂ¬Ã…Â¡ÃƒÆ’Ã¢â‚¬Å¡Ãƒâ€šÃ‚Â¬ÃƒÆ’Ã†â€™Ãƒâ€ Ã¢â‚¬â„¢ÃƒÆ’Ã¢â‚¬Â ÃƒÂ¢Ã¢â€šÂ¬Ã¢â€žÂ¢ÃƒÆ’Ã†â€™ÃƒÂ¢Ã¢â€šÂ¬Ã…Â¡ÃƒÆ’Ã¢â‚¬Å¡Ãƒâ€šÃ‚Â¢ÃƒÆ’Ã†â€™Ãƒâ€ Ã¢â‚¬â„¢ÃƒÆ’Ã¢â‚¬Å¡Ãƒâ€šÃ‚Â¢ÃƒÆ’Ã†â€™Ãƒâ€šÃ‚Â¢ÃƒÆ’Ã‚Â¢ÃƒÂ¢Ã¢â€šÂ¬Ã…Â¡Ãƒâ€šÃ‚Â¬ÃƒÆ’Ã¢â‚¬Â¦Ãƒâ€šÃ‚Â¡ÃƒÆ’Ã†â€™ÃƒÂ¢Ã¢â€šÂ¬Ã…Â¡ÃƒÆ’Ã¢â‚¬Å¡Ãƒâ€šÃ‚Â¬ÃƒÆ’Ã†â€™Ãƒâ€ Ã¢â‚¬â„¢ÃƒÆ’Ã‚Â¢ÃƒÂ¢Ã¢â‚¬Å¡Ã‚Â¬Ãƒâ€šÃ‚Â¦ÃƒÆ’Ã†â€™Ãƒâ€šÃ‚Â¢ÃƒÆ’Ã‚Â¢ÃƒÂ¢Ã¢â€šÂ¬Ã…Â¡Ãƒâ€šÃ‚Â¬ÃƒÆ’Ã¢â‚¬Â¦ÃƒÂ¢Ã¢â€šÂ¬Ã…â€œWk3), both systems recorded negative growth, with the IMTA group showing a slightly greater decline (-1.977%/day) compared to Monoculture (-0.985%/day). In the subsequent phase (Wk3ÃƒÆ’Ã†â€™Ãƒâ€ Ã¢â‚¬â„¢ÃƒÆ’Ã¢â‚¬Â ÃƒÂ¢Ã¢â€šÂ¬Ã¢â€žÂ¢ÃƒÆ’Ã†â€™ÃƒÂ¢Ã¢â€šÂ¬Ã‚Â ÃƒÆ’Ã‚Â¢ÃƒÂ¢Ã¢â‚¬Å¡Ã‚Â¬ÃƒÂ¢Ã¢â‚¬Å¾Ã‚Â¢ÃƒÆ’Ã†â€™Ãƒâ€ Ã¢â‚¬â„¢ÃƒÆ’Ã‚Â¢ÃƒÂ¢Ã¢â‚¬Å¡Ã‚Â¬Ãƒâ€¦Ã‚Â¡ÃƒÆ’Ã†â€™ÃƒÂ¢Ã¢â€šÂ¬Ã…Â¡ÃƒÆ’Ã¢â‚¬Å¡Ãƒâ€šÃ‚Â¢ÃƒÆ’Ã†â€™Ãƒâ€ Ã¢â‚¬â„¢ÃƒÆ’Ã¢â‚¬Â ÃƒÂ¢Ã¢â€šÂ¬Ã¢â€žÂ¢ÃƒÆ’Ã†â€™ÃƒÂ¢Ã¢â€šÂ¬Ã…Â¡ÃƒÆ’Ã¢â‚¬Å¡Ãƒâ€šÃ‚Â¢ÃƒÆ’Ã†â€™Ãƒâ€ Ã¢â‚¬â„¢ÃƒÆ’Ã¢â‚¬Å¡Ãƒâ€šÃ‚Â¢ÃƒÆ’Ã†â€™Ãƒâ€šÃ‚Â¢ÃƒÆ’Ã‚Â¢ÃƒÂ¢Ã¢â‚¬Å¡Ã‚Â¬Ãƒâ€¦Ã‚Â¡ÃƒÆ’Ã¢â‚¬Å¡Ãƒâ€šÃ‚Â¬ÃƒÆ’Ã†â€™ÃƒÂ¢Ã¢â€šÂ¬Ã‚Â¦ÃƒÆ’Ã¢â‚¬Å¡Ãƒâ€šÃ‚Â¡ÃƒÆ’Ã†â€™Ãƒâ€ Ã¢â‚¬â„¢ÃƒÆ’Ã‚Â¢ÃƒÂ¢Ã¢â‚¬Å¡Ã‚Â¬Ãƒâ€¦Ã‚Â¡ÃƒÆ’Ã†â€™ÃƒÂ¢Ã¢â€šÂ¬Ã…Â¡ÃƒÆ’Ã¢â‚¬Å¡Ãƒâ€šÃ‚Â¬ÃƒÆ’Ã†â€™Ãƒâ€ Ã¢â‚¬â„¢ÃƒÆ’Ã¢â‚¬Â ÃƒÂ¢Ã¢â€šÂ¬Ã¢â€žÂ¢ÃƒÆ’Ã†â€™ÃƒÂ¢Ã¢â€šÂ¬Ã…Â¡ÃƒÆ’Ã¢â‚¬Å¡Ãƒâ€šÃ‚Â¢ÃƒÆ’Ã†â€™Ãƒâ€ Ã¢â‚¬â„¢ÃƒÆ’Ã¢â‚¬Å¡Ãƒâ€šÃ‚Â¢ÃƒÆ’Ã†â€™Ãƒâ€šÃ‚Â¢ÃƒÆ’Ã‚Â¢ÃƒÂ¢Ã¢â€šÂ¬Ã…Â¡Ãƒâ€šÃ‚Â¬ÃƒÆ’Ã¢â‚¬Â¦Ãƒâ€šÃ‚Â¡ÃƒÆ’Ã†â€™ÃƒÂ¢Ã¢â€šÂ¬Ã…Â¡ÃƒÆ’Ã¢â‚¬Å¡Ãƒâ€šÃ‚Â¬ÃƒÆ’Ã†â€™Ãƒâ€ Ã¢â‚¬â„¢ÃƒÆ’Ã‚Â¢ÃƒÂ¢Ã¢â‚¬Å¡Ã‚Â¬Ãƒâ€šÃ‚Â¦ÃƒÆ’Ã†â€™Ãƒâ€šÃ‚Â¢ÃƒÆ’Ã‚Â¢ÃƒÂ¢Ã¢â€šÂ¬Ã…Â¡Ãƒâ€šÃ‚Â¬ÃƒÆ’Ã¢â‚¬Â¦ÃƒÂ¢Ã¢â€šÂ¬Ã…â€œWk4), both systems recovered strongly, with Monoculture showing a slightly higher growth rate (3.227%/day) than IMTA (2.958%/day).</w:t>
-      </w:r>
-    </w:p>
-    <w:p>
-      <w:pPr>
-        <w:spacing w:line="360" w:lineRule="auto"/>
-        <w:rPr>
-          <w:rFonts w:ascii="Times New Roman" w:hAnsi="Times New Roman" w:cs="Times New Roman"/>
-        </w:rPr>
-      </w:pPr>
-      <w:r>
-        <w:rPr>
-          <w:rFonts w:ascii="Times New Roman" w:hAnsi="Times New Roman" w:cs="Times New Roman"/>
-        </w:rPr>
-        <w:t xml:space="preserve">A clear difference in stability is observed during the Wk4ÃƒÆ’Ã†â€™Ãƒâ€ Ã¢â‚¬â„¢ÃƒÆ’Ã¢â‚¬Â ÃƒÂ¢Ã¢â€šÂ¬Ã¢â€žÂ¢ÃƒÆ’Ã†â€™ÃƒÂ¢Ã¢â€šÂ¬Ã‚Â ÃƒÆ’Ã‚Â¢ÃƒÂ¢Ã¢â‚¬Å¡Ã‚Â¬ÃƒÂ¢Ã¢â‚¬Å¾Ã‚Â¢ÃƒÆ’Ã†â€™Ãƒâ€ Ã¢â‚¬â„¢ÃƒÆ’Ã‚Â¢ÃƒÂ¢Ã¢â‚¬Å¡Ã‚Â¬Ãƒâ€¦Ã‚Â¡ÃƒÆ’Ã†â€™ÃƒÂ¢Ã¢â€šÂ¬Ã…Â¡ÃƒÆ’Ã¢â‚¬Å¡Ãƒâ€šÃ‚Â¢ÃƒÆ’Ã†â€™Ãƒâ€ Ã¢â‚¬â„¢ÃƒÆ’Ã¢â‚¬Â ÃƒÂ¢Ã¢â€šÂ¬Ã¢â€žÂ¢ÃƒÆ’Ã†â€™ÃƒÂ¢Ã¢â€šÂ¬Ã…Â¡ÃƒÆ’Ã¢â‚¬Å¡Ãƒâ€šÃ‚Â¢ÃƒÆ’Ã†â€™Ãƒâ€ Ã¢â‚¬â„¢ÃƒÆ’Ã¢â‚¬Å¡Ãƒâ€šÃ‚Â¢ÃƒÆ’Ã†â€™Ãƒâ€šÃ‚Â¢ÃƒÆ’Ã‚Â¢ÃƒÂ¢Ã¢â‚¬Å¡Ã‚Â¬Ãƒâ€¦Ã‚Â¡ÃƒÆ’Ã¢â‚¬Å¡Ãƒâ€šÃ‚Â¬ÃƒÆ’Ã†â€™ÃƒÂ¢Ã¢â€šÂ¬Ã‚Â¦ÃƒÆ’Ã¢â‚¬Å¡Ãƒâ€šÃ‚Â¡ÃƒÆ’Ã†â€™Ãƒâ€ Ã¢â‚¬â„¢ÃƒÆ’Ã‚Â¢ÃƒÂ¢Ã¢â‚¬Å¡Ã‚Â¬Ãƒâ€¦Ã‚Â¡ÃƒÆ’Ã†â€™ÃƒÂ¢Ã¢â€šÂ¬Ã…Â¡ÃƒÆ’Ã¢â‚¬Å¡Ãƒâ€šÃ‚Â¬ÃƒÆ’Ã†â€™Ãƒâ€ Ã¢â‚¬â„¢ÃƒÆ’Ã¢â‚¬Â ÃƒÂ¢Ã¢â€šÂ¬Ã¢â€žÂ¢ÃƒÆ’Ã†â€™ÃƒÂ¢Ã¢â€šÂ¬Ã…Â¡ÃƒÆ’Ã¢â‚¬Å¡Ãƒâ€šÃ‚Â¢ÃƒÆ’Ã†â€™Ãƒâ€ Ã¢â‚¬â„¢ÃƒÆ’Ã¢â‚¬Å¡Ãƒâ€šÃ‚Â¢ÃƒÆ’Ã†â€™Ãƒâ€šÃ‚Â¢ÃƒÆ’Ã‚Â¢ÃƒÂ¢Ã¢â€šÂ¬Ã…Â¡Ãƒâ€šÃ‚Â¬ÃƒÆ’Ã¢â‚¬Â¦Ãƒâ€šÃ‚Â¡ÃƒÆ’Ã†â€™ÃƒÂ¢Ã¢â€šÂ¬Ã…Â¡ÃƒÆ’Ã¢â‚¬Å¡Ãƒâ€šÃ‚Â¬ÃƒÆ’Ã†â€™Ãƒâ€ Ã¢â‚¬â„¢ÃƒÆ’Ã‚Â¢ÃƒÂ¢Ã¢â‚¬Å¡Ã‚Â¬Ãƒâ€šÃ‚Â¦ÃƒÆ’Ã†â€™Ãƒâ€šÃ‚Â¢ÃƒÆ’Ã‚Â¢ÃƒÂ¢Ã¢â€šÂ¬Ã…Â¡Ãƒâ€šÃ‚Â¬ÃƒÆ’Ã¢â‚¬Â¦ÃƒÂ¢Ã¢â€šÂ¬Ã…â€œWk5 interval, where the IMTA system remained relatively stable with a minor decline (-0.668%/day), while the Monoculture system experienced a sharp drop in growth (-9.516%/day), indicating strong physiological stress. In the final phase (Wk5ÃƒÆ’Ã†â€™Ãƒâ€ Ã¢â‚¬â„¢ÃƒÆ’Ã¢â‚¬Â ÃƒÂ¢Ã¢â€šÂ¬Ã¢â€žÂ¢ÃƒÆ’Ã†â€™ÃƒÂ¢Ã¢â€šÂ¬Ã‚Â ÃƒÆ’Ã‚Â¢ÃƒÂ¢Ã¢â‚¬Å¡Ã‚Â¬ÃƒÂ¢Ã¢â‚¬Å¾Ã‚Â¢ÃƒÆ’Ã†â€™Ãƒâ€ Ã¢â‚¬â„¢ÃƒÆ’Ã‚Â¢ÃƒÂ¢Ã¢â‚¬Å¡Ã‚Â¬Ãƒâ€¦Ã‚Â¡ÃƒÆ’Ã†â€™ÃƒÂ¢Ã¢â€šÂ¬Ã…Â¡ÃƒÆ’Ã¢â‚¬Å¡Ãƒâ€šÃ‚Â¢ÃƒÆ’Ã†â€™Ãƒâ€ Ã¢â‚¬â„¢ÃƒÆ’Ã¢â‚¬Â ÃƒÂ¢Ã¢â€šÂ¬Ã¢â€žÂ¢ÃƒÆ’Ã†â€™ÃƒÂ¢Ã¢â€šÂ¬Ã…Â¡ÃƒÆ’Ã¢â‚¬Å¡Ãƒâ€šÃ‚Â¢ÃƒÆ’Ã†â€™Ãƒâ€ Ã¢â‚¬â„¢ÃƒÆ’Ã¢â‚¬Å¡Ãƒâ€šÃ‚Â¢ÃƒÆ’Ã†â€™Ãƒâ€šÃ‚Â¢ÃƒÆ’Ã‚Â¢ÃƒÂ¢Ã¢â‚¬Å¡Ã‚Â¬Ãƒâ€¦Ã‚Â¡ÃƒÆ’Ã¢â‚¬Å¡Ãƒâ€šÃ‚Â¬ÃƒÆ’Ã†â€™ÃƒÂ¢Ã¢â€šÂ¬Ã‚Â¦ÃƒÆ’Ã¢â‚¬Å¡Ãƒâ€šÃ‚Â¡ÃƒÆ’Ã†â€™Ãƒâ€ Ã¢â‚¬â„¢ÃƒÆ’Ã‚Â¢ÃƒÂ¢Ã¢â‚¬Å¡Ã‚Â¬Ãƒâ€¦Ã‚Â¡ÃƒÆ’Ã†â€™ÃƒÂ¢Ã¢â€šÂ¬Ã…Â¡ÃƒÆ’Ã¢â‚¬Å¡Ãƒâ€šÃ‚Â¬ÃƒÆ’Ã†â€™Ãƒâ€ Ã¢â‚¬â„¢ÃƒÆ’Ã¢â‚¬Â ÃƒÂ¢Ã¢â€šÂ¬Ã¢â€žÂ¢ÃƒÆ’Ã†â€™ÃƒÂ¢Ã¢â€šÂ¬Ã…Â¡ÃƒÆ’Ã¢â‚¬Å¡Ãƒâ€šÃ‚Â¢ÃƒÆ’Ã†â€™Ãƒâ€ Ã¢â‚¬â„¢ÃƒÆ’Ã¢â‚¬Å¡Ãƒâ€šÃ‚Â¢ÃƒÆ’Ã†â€™Ãƒâ€šÃ‚Â¢ÃƒÆ’Ã‚Â¢ÃƒÂ¢Ã¢â€šÂ¬Ã…Â¡Ãƒâ€šÃ‚Â¬ÃƒÆ’Ã¢â‚¬Â¦Ãƒâ€šÃ‚Â¡ÃƒÆ’Ã†â€™ÃƒÂ¢Ã¢â€šÂ¬Ã…Â¡ÃƒÆ’Ã¢â‚¬Å¡Ãƒâ€šÃ‚Â¬ÃƒÆ’Ã†â€™Ãƒâ€ Ã¢â‚¬â„¢ÃƒÆ’Ã‚Â¢ÃƒÂ¢Ã¢â‚¬Å¡Ã‚Â¬Ãƒâ€šÃ‚Â¦ÃƒÆ’Ã†â€™Ãƒâ€šÃ‚Â¢ÃƒÆ’Ã‚Â¢ÃƒÂ¢Ã¢â€šÂ¬Ã…Â¡Ãƒâ€šÃ‚Â¬ÃƒÆ’Ã¢â‚¬Â¦ÃƒÂ¢Ã¢â€šÂ¬Ã…â€œWk6), both systems recovered, with Monoculture reaching a higher peak growth rate (4.872%/day) compared to IMTA (2.246%/day). Overall, although Monoculture showed higher peak SGR values, the IMTA system demonstrated more stable and consistent </w:t>
+        <w:t xml:space="preserve"> (%/day) in IMTA and Monoculture systems across four sampling intervals. Overall, both treatments show fluctuating growth patterns, including phases of weight loss and recovery. During the initial adaptation phase (Wk2ÃƒÆ’Ã†â€™Ãƒâ€ Ã¢â‚¬â„¢ÃƒÆ’Ã¢â‚¬Â ÃƒÂ¢Ã¢â€šÂ¬Ã¢â€žÂ¢ÃƒÆ’Ã†â€™ÃƒÂ¢Ã¢â€šÂ¬Ã‚Â ÃƒÆ’Ã‚Â¢ÃƒÂ¢Ã¢â‚¬Å¡Ã‚Â¬ÃƒÂ¢Ã¢â‚¬Å¾Ã‚Â¢ÃƒÆ’Ã†â€™Ãƒâ€ Ã¢â‚¬â„¢ÃƒÆ’Ã‚Â¢ÃƒÂ¢Ã¢â‚¬Å¡Ã‚Â¬Ãƒâ€šÃ‚Â ÃƒÆ’Ã†â€™Ãƒâ€šÃ‚Â¢ÃƒÆ’Ã‚Â¢ÃƒÂ¢Ã¢â€šÂ¬Ã…Â¡Ãƒâ€šÃ‚Â¬ÃƒÆ’Ã‚Â¢ÃƒÂ¢Ã¢â€šÂ¬Ã…Â¾Ãƒâ€šÃ‚Â¢ÃƒÆ’Ã†â€™Ãƒâ€ Ã¢â‚¬â„¢ÃƒÆ’Ã¢â‚¬Â ÃƒÂ¢Ã¢â€šÂ¬Ã¢â€žÂ¢ÃƒÆ’Ã†â€™Ãƒâ€šÃ‚Â¢ÃƒÆ’Ã‚Â¢ÃƒÂ¢Ã¢â€šÂ¬Ã…Â¡Ãƒâ€šÃ‚Â¬ÃƒÆ’Ã¢â‚¬Å¡Ãƒâ€šÃ‚Â ÃƒÆ’Ã†â€™Ãƒâ€ Ã¢â‚¬â„¢ÃƒÆ’Ã¢â‚¬Å¡Ãƒâ€šÃ‚Â¢ÃƒÆ’Ã†â€™Ãƒâ€šÃ‚Â¢ÃƒÆ’Ã‚Â¢ÃƒÂ¢Ã¢â‚¬Å¡Ã‚Â¬Ãƒâ€¦Ã‚Â¡ÃƒÆ’Ã¢â‚¬Å¡Ãƒâ€šÃ‚Â¬ÃƒÆ’Ã†â€™Ãƒâ€šÃ‚Â¢ÃƒÆ’Ã‚Â¢ÃƒÂ¢Ã¢â‚¬Å¡Ã‚Â¬Ãƒâ€¦Ã‚Â¾ÃƒÆ’Ã¢â‚¬Å¡Ãƒâ€šÃ‚Â¢ÃƒÆ’Ã†â€™Ãƒâ€ Ã¢â‚¬â„¢ÃƒÆ’Ã¢â‚¬Â ÃƒÂ¢Ã¢â€šÂ¬Ã¢â€žÂ¢ÃƒÆ’Ã†â€™ÃƒÂ¢Ã¢â€šÂ¬Ã‚Â ÃƒÆ’Ã‚Â¢ÃƒÂ¢Ã¢â‚¬Å¡Ã‚Â¬ÃƒÂ¢Ã¢â‚¬Å¾Ã‚Â¢ÃƒÆ’Ã†â€™Ãƒâ€ Ã¢â‚¬â„¢ÃƒÆ’Ã¢â‚¬Å¡Ãƒâ€šÃ‚Â¢ÃƒÆ’Ã†â€™Ãƒâ€šÃ‚Â¢ÃƒÆ’Ã‚Â¢ÃƒÂ¢Ã¢â‚¬Å¡Ã‚Â¬Ãƒâ€¦Ã‚Â¡ÃƒÆ’Ã¢â‚¬Å¡Ãƒâ€šÃ‚Â¬ÃƒÆ’Ã†â€™ÃƒÂ¢Ã¢â€šÂ¬Ã‚Â¦ÃƒÆ’Ã¢â‚¬Å¡Ãƒâ€šÃ‚Â¡ÃƒÆ’Ã†â€™Ãƒâ€ Ã¢â‚¬â„¢ÃƒÆ’Ã¢â‚¬Â ÃƒÂ¢Ã¢â€šÂ¬Ã¢â€žÂ¢ÃƒÆ’Ã†â€™Ãƒâ€šÃ‚Â¢ÃƒÆ’Ã‚Â¢ÃƒÂ¢Ã¢â€šÂ¬Ã…Â¡Ãƒâ€šÃ‚Â¬ÃƒÆ’Ã¢â‚¬Â¦Ãƒâ€šÃ‚Â¡ÃƒÆ’Ã†â€™Ãƒâ€ Ã¢â‚¬â„¢ÃƒÆ’Ã‚Â¢ÃƒÂ¢Ã¢â‚¬Å¡Ã‚Â¬Ãƒâ€¦Ã‚Â¡ÃƒÆ’Ã†â€™ÃƒÂ¢Ã¢â€šÂ¬Ã…Â¡ÃƒÆ’Ã¢â‚¬Å¡Ãƒâ€šÃ‚Â¢ÃƒÆ’Ã†â€™Ãƒâ€ Ã¢â‚¬â„¢ÃƒÆ’Ã¢â‚¬Â ÃƒÂ¢Ã¢â€šÂ¬Ã¢â€žÂ¢ÃƒÆ’Ã†â€™ÃƒÂ¢Ã¢â€šÂ¬Ã‚Â ÃƒÆ’Ã‚Â¢ÃƒÂ¢Ã¢â‚¬Å¡Ã‚Â¬ÃƒÂ¢Ã¢â‚¬Å¾Ã‚Â¢ÃƒÆ’Ã†â€™Ãƒâ€ Ã¢â‚¬â„¢ÃƒÆ’Ã‚Â¢ÃƒÂ¢Ã¢â‚¬Å¡Ã‚Â¬Ãƒâ€šÃ‚Â ÃƒÆ’Ã†â€™Ãƒâ€šÃ‚Â¢ÃƒÆ’Ã‚Â¢ÃƒÂ¢Ã¢â€šÂ¬Ã…Â¡Ãƒâ€šÃ‚Â¬ÃƒÆ’Ã‚Â¢ÃƒÂ¢Ã¢â€šÂ¬Ã…Â¾Ãƒâ€šÃ‚Â¢ÃƒÆ’Ã†â€™Ãƒâ€ Ã¢â‚¬â„¢ÃƒÆ’Ã¢â‚¬Â ÃƒÂ¢Ã¢â€šÂ¬Ã¢â€žÂ¢ÃƒÆ’Ã†â€™Ãƒâ€šÃ‚Â¢ÃƒÆ’Ã‚Â¢ÃƒÂ¢Ã¢â€šÂ¬Ã…Â¡Ãƒâ€šÃ‚Â¬ÃƒÆ’Ã¢â‚¬Â¦Ãƒâ€šÃ‚Â¡ÃƒÆ’Ã†â€™Ãƒâ€ Ã¢â‚¬â„¢ÃƒÆ’Ã‚Â¢ÃƒÂ¢Ã¢â‚¬Å¡Ã‚Â¬Ãƒâ€¦Ã‚Â¡ÃƒÆ’Ã†â€™ÃƒÂ¢Ã¢â€šÂ¬Ã…Â¡ÃƒÆ’Ã¢â‚¬Å¡Ãƒâ€šÃ‚Â¢ÃƒÆ’Ã†â€™Ãƒâ€ Ã¢â‚¬â„¢ÃƒÆ’Ã¢â‚¬Â ÃƒÂ¢Ã¢â€šÂ¬Ã¢â€žÂ¢ÃƒÆ’Ã†â€™ÃƒÂ¢Ã¢â€šÂ¬Ã‚Â ÃƒÆ’Ã‚Â¢ÃƒÂ¢Ã¢â‚¬Å¡Ã‚Â¬ÃƒÂ¢Ã¢â‚¬Å¾Ã‚Â¢ÃƒÆ’Ã†â€™Ãƒâ€ Ã¢â‚¬â„¢ÃƒÆ’Ã‚Â¢ÃƒÂ¢Ã¢â‚¬Å¡Ã‚Â¬Ãƒâ€¦Ã‚Â¡ÃƒÆ’Ã†â€™ÃƒÂ¢Ã¢â€šÂ¬Ã…Â¡ÃƒÆ’Ã¢â‚¬Å¡Ãƒâ€šÃ‚Â¢ÃƒÆ’Ã†â€™Ãƒâ€ Ã¢â‚¬â„¢ÃƒÆ’Ã¢â‚¬Â ÃƒÂ¢Ã¢â€šÂ¬Ã¢â€žÂ¢ÃƒÆ’Ã†â€™ÃƒÂ¢Ã¢â€šÂ¬Ã…Â¡ÃƒÆ’Ã¢â‚¬Å¡Ãƒâ€šÃ‚Â¢ÃƒÆ’Ã†â€™Ãƒâ€ Ã¢â‚¬â„¢ÃƒÆ’Ã¢â‚¬Å¡Ãƒâ€šÃ‚Â¢ÃƒÆ’Ã†â€™Ãƒâ€šÃ‚Â¢ÃƒÆ’Ã‚Â¢ÃƒÂ¢Ã¢â‚¬Å¡Ã‚Â¬Ãƒâ€¦Ã‚Â¡ÃƒÆ’Ã¢â‚¬Å¡Ãƒâ€šÃ‚Â¬ÃƒÆ’Ã†â€™ÃƒÂ¢Ã¢â€šÂ¬Ã‚Â¦ÃƒÆ’Ã¢â‚¬Å¡Ãƒâ€šÃ‚Â¡ÃƒÆ’Ã†â€™Ãƒâ€ Ã¢â‚¬â„¢ÃƒÆ’Ã‚Â¢ÃƒÂ¢Ã¢â‚¬Å¡Ã‚Â¬Ãƒâ€¦Ã‚Â¡ÃƒÆ’Ã†â€™ÃƒÂ¢Ã¢â€šÂ¬Ã…Â¡ÃƒÆ’Ã¢â‚¬Å¡Ãƒâ€šÃ‚Â¬ÃƒÆ’Ã†â€™Ãƒâ€ Ã¢â‚¬â„¢ÃƒÆ’Ã¢â‚¬Â ÃƒÂ¢Ã¢â€šÂ¬Ã¢â€žÂ¢ÃƒÆ’Ã†â€™Ãƒâ€šÃ‚Â¢ÃƒÆ’Ã‚Â¢ÃƒÂ¢Ã¢â€šÂ¬Ã…Â¡Ãƒâ€šÃ‚Â¬ÃƒÆ’Ã¢â‚¬Å¡Ãƒâ€šÃ‚Â¦ÃƒÆ’Ã†â€™Ãƒâ€ Ã¢â‚¬â„¢ÃƒÆ’Ã‚Â¢ÃƒÂ¢Ã¢â‚¬Å¡Ã‚Â¬Ãƒâ€¦Ã‚Â¡ÃƒÆ’Ã†â€™ÃƒÂ¢Ã¢â€šÂ¬Ã…Â¡ÃƒÆ’Ã¢â‚¬Å¡Ãƒâ€šÃ‚Â¡ÃƒÆ’Ã†â€™Ãƒâ€ Ã¢â‚¬â„¢ÃƒÆ’Ã¢â‚¬Â ÃƒÂ¢Ã¢â€šÂ¬Ã¢â€žÂ¢ÃƒÆ’Ã†â€™ÃƒÂ¢Ã¢â€šÂ¬Ã‚Â ÃƒÆ’Ã‚Â¢ÃƒÂ¢Ã¢â‚¬Å¡Ã‚Â¬ÃƒÂ¢Ã¢â‚¬Å¾Ã‚Â¢ÃƒÆ’Ã†â€™Ãƒâ€ Ã¢â‚¬â„¢ÃƒÆ’Ã¢â‚¬Å¡Ãƒâ€šÃ‚Â¢ÃƒÆ’Ã†â€™Ãƒâ€šÃ‚Â¢ÃƒÆ’Ã‚Â¢ÃƒÂ¢Ã¢â‚¬Å¡Ã‚Â¬Ãƒâ€¦Ã‚Â¡ÃƒÆ’Ã¢â‚¬Å¡Ãƒâ€šÃ‚Â¬ÃƒÆ’Ã†â€™ÃƒÂ¢Ã¢â€šÂ¬Ã‚Â¦ÃƒÆ’Ã¢â‚¬Å¡Ãƒâ€šÃ‚Â¡ÃƒÆ’Ã†â€™Ãƒâ€ Ã¢â‚¬â„¢ÃƒÆ’Ã¢â‚¬Â ÃƒÂ¢Ã¢â€šÂ¬Ã¢â€žÂ¢ÃƒÆ’Ã†â€™Ãƒâ€šÃ‚Â¢ÃƒÆ’Ã‚Â¢ÃƒÂ¢Ã¢â€šÂ¬Ã…Â¡Ãƒâ€šÃ‚Â¬ÃƒÆ’Ã¢â‚¬Â¦Ãƒâ€šÃ‚Â¡ÃƒÆ’Ã†â€™Ãƒâ€ Ã¢â‚¬â„¢ÃƒÆ’Ã‚Â¢ÃƒÂ¢Ã¢â‚¬Å¡Ã‚Â¬Ãƒâ€¦Ã‚Â¡ÃƒÆ’Ã†â€™ÃƒÂ¢Ã¢â€šÂ¬Ã…Â¡ÃƒÆ’Ã¢â‚¬Å¡Ãƒâ€šÃ‚Â¬ÃƒÆ’Ã†â€™Ãƒâ€ Ã¢â‚¬â„¢ÃƒÆ’Ã¢â‚¬Â ÃƒÂ¢Ã¢â€šÂ¬Ã¢â€žÂ¢ÃƒÆ’Ã†â€™ÃƒÂ¢Ã¢â€šÂ¬Ã‚Â ÃƒÆ’Ã‚Â¢ÃƒÂ¢Ã¢â‚¬Å¡Ã‚Â¬ÃƒÂ¢Ã¢â‚¬Å¾Ã‚Â¢ÃƒÆ’Ã†â€™Ãƒâ€ Ã¢â‚¬â„¢ÃƒÆ’Ã‚Â¢ÃƒÂ¢Ã¢â‚¬Å¡Ã‚Â¬Ãƒâ€šÃ‚Â ÃƒÆ’Ã†â€™Ãƒâ€šÃ‚Â¢ÃƒÆ’Ã‚Â¢ÃƒÂ¢Ã¢â€šÂ¬Ã…Â¡Ãƒâ€šÃ‚Â¬ÃƒÆ’Ã‚Â¢ÃƒÂ¢Ã¢â€šÂ¬Ã…Â¾Ãƒâ€šÃ‚Â¢ÃƒÆ’Ã†â€™Ãƒâ€ Ã¢â‚¬â„¢ÃƒÆ’Ã¢â‚¬Â ÃƒÂ¢Ã¢â€šÂ¬Ã¢â€žÂ¢ÃƒÆ’Ã†â€™Ãƒâ€šÃ‚Â¢ÃƒÆ’Ã‚Â¢ÃƒÂ¢Ã¢â€šÂ¬Ã…Â¡Ãƒâ€šÃ‚Â¬ÃƒÆ’Ã¢â‚¬Â¦Ãƒâ€šÃ‚Â¡ÃƒÆ’Ã†â€™Ãƒâ€ Ã¢â‚¬â„¢ÃƒÆ’Ã‚Â¢ÃƒÂ¢Ã¢â‚¬Å¡Ã‚Â¬Ãƒâ€¦Ã‚Â¡ÃƒÆ’Ã†â€™ÃƒÂ¢Ã¢â€šÂ¬Ã…Â¡ÃƒÆ’Ã¢â‚¬Å¡Ãƒâ€šÃ‚Â¢ÃƒÆ’Ã†â€™Ãƒâ€ Ã¢â‚¬â„¢ÃƒÆ’Ã¢â‚¬Â ÃƒÂ¢Ã¢â€šÂ¬Ã¢â€žÂ¢ÃƒÆ’Ã†â€™ÃƒÂ¢Ã¢â€šÂ¬Ã‚Â ÃƒÆ’Ã‚Â¢ÃƒÂ¢Ã¢â‚¬Å¡Ã‚Â¬ÃƒÂ¢Ã¢â‚¬Å¾Ã‚Â¢ÃƒÆ’Ã†â€™Ãƒâ€ Ã¢â‚¬â„¢ÃƒÆ’Ã‚Â¢ÃƒÂ¢Ã¢â‚¬Å¡Ã‚Â¬Ãƒâ€¦Ã‚Â¡ÃƒÆ’Ã†â€™ÃƒÂ¢Ã¢â€šÂ¬Ã…Â¡ÃƒÆ’Ã¢â‚¬Å¡Ãƒâ€šÃ‚Â¢ÃƒÆ’Ã†â€™Ãƒâ€ Ã¢â‚¬â„¢ÃƒÆ’Ã¢â‚¬Â ÃƒÂ¢Ã¢â€šÂ¬Ã¢â€žÂ¢ÃƒÆ’Ã†â€™ÃƒÂ¢Ã¢â€šÂ¬Ã…Â¡ÃƒÆ’Ã¢â‚¬Å¡Ãƒâ€šÃ‚Â¢ÃƒÆ’Ã†â€™Ãƒâ€ Ã¢â‚¬â„¢ÃƒÆ’Ã¢â‚¬Å¡Ãƒâ€šÃ‚Â¢ÃƒÆ’Ã†â€™Ãƒâ€šÃ‚Â¢ÃƒÆ’Ã‚Â¢ÃƒÂ¢Ã¢â€šÂ¬Ã…Â¡Ãƒâ€šÃ‚Â¬ÃƒÆ’Ã¢â‚¬Â¦Ãƒâ€šÃ‚Â¡ÃƒÆ’Ã†â€™ÃƒÂ¢Ã¢â€šÂ¬Ã…Â¡ÃƒÆ’Ã¢â‚¬Å¡Ãƒâ€šÃ‚Â¬ÃƒÆ’Ã†â€™Ãƒâ€ Ã¢â‚¬â„¢ÃƒÆ’Ã‚Â¢ÃƒÂ¢Ã¢â‚¬Å¡Ã‚Â¬Ãƒâ€šÃ‚Â¦ÃƒÆ’Ã†â€™ÃƒÂ¢Ã¢â€šÂ¬Ã…Â¡ÃƒÆ’Ã¢â‚¬Å¡Ãƒâ€šÃ‚Â¡ÃƒÆ’Ã†â€™Ãƒâ€ Ã¢â‚¬â„¢ÃƒÆ’Ã¢â‚¬Â ÃƒÂ¢Ã¢â€šÂ¬Ã¢â€žÂ¢ÃƒÆ’Ã†â€™Ãƒâ€šÃ‚Â¢ÃƒÆ’Ã‚Â¢ÃƒÂ¢Ã¢â€šÂ¬Ã…Â¡Ãƒâ€šÃ‚Â¬ÃƒÆ’Ã¢â‚¬Â¦Ãƒâ€šÃ‚Â¡ÃƒÆ’Ã†â€™Ãƒâ€ Ã¢â‚¬â„¢ÃƒÆ’Ã‚Â¢ÃƒÂ¢Ã¢â‚¬Å¡Ã‚Â¬Ãƒâ€¦Ã‚Â¡ÃƒÆ’Ã†â€™ÃƒÂ¢Ã¢â€šÂ¬Ã…Â¡ÃƒÆ’Ã¢â‚¬Å¡Ãƒâ€šÃ‚Â¬ÃƒÆ’Ã†â€™Ãƒâ€ Ã¢â‚¬â„¢ÃƒÆ’Ã¢â‚¬Â ÃƒÂ¢Ã¢â€šÂ¬Ã¢â€žÂ¢ÃƒÆ’Ã†â€™ÃƒÂ¢Ã¢â€šÂ¬Ã‚Â ÃƒÆ’Ã‚Â¢ÃƒÂ¢Ã¢â‚¬Å¡Ã‚Â¬ÃƒÂ¢Ã¢â‚¬Å¾Ã‚Â¢ÃƒÆ’Ã†â€™Ãƒâ€ Ã¢â‚¬â„¢ÃƒÆ’Ã¢â‚¬Å¡Ãƒâ€šÃ‚Â¢ÃƒÆ’Ã†â€™Ãƒâ€šÃ‚Â¢ÃƒÆ’Ã‚Â¢ÃƒÂ¢Ã¢â‚¬Å¡Ã‚Â¬Ãƒâ€¦Ã‚Â¡ÃƒÆ’Ã¢â‚¬Å¡Ãƒâ€šÃ‚Â¬ÃƒÆ’Ã†â€™ÃƒÂ¢Ã¢â€šÂ¬Ã…Â¡ÃƒÆ’Ã¢â‚¬Å¡Ãƒâ€šÃ‚Â¦ÃƒÆ’Ã†â€™Ãƒâ€ Ã¢â‚¬â„¢ÃƒÆ’Ã¢â‚¬Â ÃƒÂ¢Ã¢â€šÂ¬Ã¢â€žÂ¢ÃƒÆ’Ã†â€™ÃƒÂ¢Ã¢â€šÂ¬Ã…Â¡ÃƒÆ’Ã¢â‚¬Å¡Ãƒâ€šÃ‚Â¢ÃƒÆ’Ã†â€™Ãƒâ€ Ã¢â‚¬â„¢ÃƒÆ’Ã¢â‚¬Å¡Ãƒâ€šÃ‚Â¢ÃƒÆ’Ã†â€™Ãƒâ€šÃ‚Â¢ÃƒÆ’Ã‚Â¢ÃƒÂ¢Ã¢â€šÂ¬Ã…Â¡Ãƒâ€šÃ‚Â¬ÃƒÆ’Ã¢â‚¬Â¦Ãƒâ€šÃ‚Â¡ÃƒÆ’Ã†â€™ÃƒÂ¢Ã¢â€šÂ¬Ã…Â¡ÃƒÆ’Ã¢â‚¬Å¡Ãƒâ€šÃ‚Â¬ÃƒÆ’Ã†â€™Ãƒâ€ Ã¢â‚¬â„¢ÃƒÆ’Ã‚Â¢ÃƒÂ¢Ã¢â‚¬Å¡Ã‚Â¬Ãƒâ€šÃ‚Â¦ÃƒÆ’Ã†â€™Ãƒâ€šÃ‚Â¢ÃƒÆ’Ã‚Â¢ÃƒÂ¢Ã¢â€šÂ¬Ã…Â¡Ãƒâ€šÃ‚Â¬ÃƒÆ’Ã¢â‚¬Â¦ÃƒÂ¢Ã¢â€šÂ¬Ã…â€œWk3), both systems recorded negative growth, with the IMTA group showing a slightly greater decline (-1.977%/day) compared to Monoculture (-0.985%/day). In the subsequent phase (Wk3ÃƒÆ’Ã†â€™Ãƒâ€ Ã¢â‚¬â„¢ÃƒÆ’Ã¢â‚¬Â ÃƒÂ¢Ã¢â€šÂ¬Ã¢â€žÂ¢ÃƒÆ’Ã†â€™ÃƒÂ¢Ã¢â€šÂ¬Ã‚Â ÃƒÆ’Ã‚Â¢ÃƒÂ¢Ã¢â‚¬Å¡Ã‚Â¬ÃƒÂ¢Ã¢â‚¬Å¾Ã‚Â¢ÃƒÆ’Ã†â€™Ãƒâ€ Ã¢â‚¬â„¢ÃƒÆ’Ã‚Â¢ÃƒÂ¢Ã¢â‚¬Å¡Ã‚Â¬Ãƒâ€šÃ‚Â ÃƒÆ’Ã†â€™Ãƒâ€šÃ‚Â¢ÃƒÆ’Ã‚Â¢ÃƒÂ¢Ã¢â€šÂ¬Ã…Â¡Ãƒâ€šÃ‚Â¬ÃƒÆ’Ã‚Â¢ÃƒÂ¢Ã¢â€šÂ¬Ã…Â¾Ãƒâ€šÃ‚Â¢ÃƒÆ’Ã†â€™Ãƒâ€ Ã¢â‚¬â„¢ÃƒÆ’Ã¢â‚¬Â ÃƒÂ¢Ã¢â€šÂ¬Ã¢â€žÂ¢ÃƒÆ’Ã†â€™Ãƒâ€šÃ‚Â¢ÃƒÆ’Ã‚Â¢ÃƒÂ¢Ã¢â€šÂ¬Ã…Â¡Ãƒâ€šÃ‚Â¬ÃƒÆ’Ã¢â‚¬Å¡Ãƒâ€šÃ‚Â ÃƒÆ’Ã†â€™Ãƒâ€ Ã¢â‚¬â„¢ÃƒÆ’Ã¢â‚¬Å¡Ãƒâ€šÃ‚Â¢ÃƒÆ’Ã†â€™Ãƒâ€šÃ‚Â¢ÃƒÆ’Ã‚Â¢ÃƒÂ¢Ã¢â‚¬Å¡Ã‚Â¬Ãƒâ€¦Ã‚Â¡ÃƒÆ’Ã¢â‚¬Å¡Ãƒâ€šÃ‚Â¬ÃƒÆ’Ã†â€™Ãƒâ€šÃ‚Â¢ÃƒÆ’Ã‚Â¢ÃƒÂ¢Ã¢â‚¬Å¡Ã‚Â¬Ãƒâ€¦Ã‚Â¾ÃƒÆ’Ã¢â‚¬Å¡Ãƒâ€šÃ‚Â¢ÃƒÆ’Ã†â€™Ãƒâ€ Ã¢â‚¬â„¢ÃƒÆ’Ã¢â‚¬Â ÃƒÂ¢Ã¢â€šÂ¬Ã¢â€žÂ¢ÃƒÆ’Ã†â€™ÃƒÂ¢Ã¢â€šÂ¬Ã‚Â ÃƒÆ’Ã‚Â¢ÃƒÂ¢Ã¢â‚¬Å¡Ã‚Â¬ÃƒÂ¢Ã¢â‚¬Å¾Ã‚Â¢ÃƒÆ’Ã†â€™Ãƒâ€ Ã¢â‚¬â„¢ÃƒÆ’Ã¢â‚¬Å¡Ãƒâ€šÃ‚Â¢ÃƒÆ’Ã†â€™Ãƒâ€šÃ‚Â¢ÃƒÆ’Ã‚Â¢ÃƒÂ¢Ã¢â‚¬Å¡Ã‚Â¬Ãƒâ€¦Ã‚Â¡ÃƒÆ’Ã¢â‚¬Å¡Ãƒâ€šÃ‚Â¬ÃƒÆ’Ã†â€™ÃƒÂ¢Ã¢â€šÂ¬Ã‚Â¦ÃƒÆ’Ã¢â‚¬Å¡Ãƒâ€šÃ‚Â¡ÃƒÆ’Ã†â€™Ãƒâ€ Ã¢â‚¬â„¢ÃƒÆ’Ã¢â‚¬Â ÃƒÂ¢Ã¢â€šÂ¬Ã¢â€žÂ¢ÃƒÆ’Ã†â€™Ãƒâ€šÃ‚Â¢ÃƒÆ’Ã‚Â¢ÃƒÂ¢Ã¢â€šÂ¬Ã…Â¡Ãƒâ€šÃ‚Â¬ÃƒÆ’Ã¢â‚¬Â¦Ãƒâ€šÃ‚Â¡ÃƒÆ’Ã†â€™Ãƒâ€ Ã¢â‚¬â„¢ÃƒÆ’Ã‚Â¢ÃƒÂ¢Ã¢â‚¬Å¡Ã‚Â¬Ãƒâ€¦Ã‚Â¡ÃƒÆ’Ã†â€™ÃƒÂ¢Ã¢â€šÂ¬Ã…Â¡ÃƒÆ’Ã¢â‚¬Å¡Ãƒâ€šÃ‚Â¢ÃƒÆ’Ã†â€™Ãƒâ€ Ã¢â‚¬â„¢ÃƒÆ’Ã¢â‚¬Â ÃƒÂ¢Ã¢â€šÂ¬Ã¢â€žÂ¢ÃƒÆ’Ã†â€™ÃƒÂ¢Ã¢â€šÂ¬Ã‚Â ÃƒÆ’Ã‚Â¢ÃƒÂ¢Ã¢â‚¬Å¡Ã‚Â¬ÃƒÂ¢Ã¢â‚¬Å¾Ã‚Â¢ÃƒÆ’Ã†â€™Ãƒâ€ Ã¢â‚¬â„¢ÃƒÆ’Ã‚Â¢ÃƒÂ¢Ã¢â‚¬Å¡Ã‚Â¬Ãƒâ€šÃ‚Â ÃƒÆ’Ã†â€™Ãƒâ€šÃ‚Â¢ÃƒÆ’Ã‚Â¢ÃƒÂ¢Ã¢â€šÂ¬Ã…Â¡Ãƒâ€šÃ‚Â¬ÃƒÆ’Ã‚Â¢ÃƒÂ¢Ã¢â€šÂ¬Ã…Â¾Ãƒâ€šÃ‚Â¢ÃƒÆ’Ã†â€™Ãƒâ€ Ã¢â‚¬â„¢ÃƒÆ’Ã¢â‚¬Â ÃƒÂ¢Ã¢â€šÂ¬Ã¢â€žÂ¢ÃƒÆ’Ã†â€™Ãƒâ€šÃ‚Â¢ÃƒÆ’Ã‚Â¢ÃƒÂ¢Ã¢â€šÂ¬Ã…Â¡Ãƒâ€šÃ‚Â¬ÃƒÆ’Ã¢â‚¬Â¦Ãƒâ€šÃ‚Â¡ÃƒÆ’Ã†â€™Ãƒâ€ Ã¢â‚¬â„¢ÃƒÆ’Ã‚Â¢ÃƒÂ¢Ã¢â‚¬Å¡Ã‚Â¬Ãƒâ€¦Ã‚Â¡ÃƒÆ’Ã†â€™ÃƒÂ¢Ã¢â€šÂ¬Ã…Â¡ÃƒÆ’Ã¢â‚¬Å¡Ãƒâ€šÃ‚Â¢ÃƒÆ’Ã†â€™Ãƒâ€ Ã¢â‚¬â„¢ÃƒÆ’Ã¢â‚¬Â ÃƒÂ¢Ã¢â€šÂ¬Ã¢â€žÂ¢ÃƒÆ’Ã†â€™ÃƒÂ¢Ã¢â€šÂ¬Ã‚Â ÃƒÆ’Ã‚Â¢ÃƒÂ¢Ã¢â‚¬Å¡Ã‚Â¬ÃƒÂ¢Ã¢â‚¬Å¾Ã‚Â¢ÃƒÆ’Ã†â€™Ãƒâ€ Ã¢â‚¬â„¢ÃƒÆ’Ã‚Â¢ÃƒÂ¢Ã¢â‚¬Å¡Ã‚Â¬Ãƒâ€¦Ã‚Â¡ÃƒÆ’Ã†â€™ÃƒÂ¢Ã¢â€šÂ¬Ã…Â¡ÃƒÆ’Ã¢â‚¬Å¡Ãƒâ€šÃ‚Â¢ÃƒÆ’Ã†â€™Ãƒâ€ Ã¢â‚¬â„¢ÃƒÆ’Ã¢â‚¬Â ÃƒÂ¢Ã¢â€šÂ¬Ã¢â€žÂ¢ÃƒÆ’Ã†â€™ÃƒÂ¢Ã¢â€šÂ¬Ã…Â¡ÃƒÆ’Ã¢â‚¬Å¡Ãƒâ€šÃ‚Â¢ÃƒÆ’Ã†â€™Ãƒâ€ Ã¢â‚¬â„¢ÃƒÆ’Ã¢â‚¬Å¡Ãƒâ€šÃ‚Â¢ÃƒÆ’Ã†â€™Ãƒâ€šÃ‚Â¢ÃƒÆ’Ã‚Â¢ÃƒÂ¢Ã¢â‚¬Å¡Ã‚Â¬Ãƒâ€¦Ã‚Â¡ÃƒÆ’Ã¢â‚¬Å¡Ãƒâ€šÃ‚Â¬ÃƒÆ’Ã†â€™ÃƒÂ¢Ã¢â€šÂ¬Ã‚Â¦ÃƒÆ’Ã¢â‚¬Å¡Ãƒâ€šÃ‚Â¡ÃƒÆ’Ã†â€™Ãƒâ€ Ã¢â‚¬â„¢ÃƒÆ’Ã‚Â¢ÃƒÂ¢Ã¢â‚¬Å¡Ã‚Â¬Ãƒâ€¦Ã‚Â¡ÃƒÆ’Ã†â€™ÃƒÂ¢Ã¢â€šÂ¬Ã…Â¡ÃƒÆ’Ã¢â‚¬Å¡Ãƒâ€šÃ‚Â¬ÃƒÆ’Ã†â€™Ãƒâ€ Ã¢â‚¬â„¢ÃƒÆ’Ã¢â‚¬Â ÃƒÂ¢Ã¢â€šÂ¬Ã¢â€žÂ¢ÃƒÆ’Ã†â€™Ãƒâ€šÃ‚Â¢ÃƒÆ’Ã‚Â¢ÃƒÂ¢Ã¢â€šÂ¬Ã…Â¡Ãƒâ€šÃ‚Â¬ÃƒÆ’Ã¢â‚¬Å¡Ãƒâ€šÃ‚Â¦ÃƒÆ’Ã†â€™Ãƒâ€ Ã¢â‚¬â„¢ÃƒÆ’Ã‚Â¢ÃƒÂ¢Ã¢â‚¬Å¡Ã‚Â¬Ãƒâ€¦Ã‚Â¡ÃƒÆ’Ã†â€™ÃƒÂ¢Ã¢â€šÂ¬Ã…Â¡ÃƒÆ’Ã¢â‚¬Å¡Ãƒâ€šÃ‚Â¡ÃƒÆ’Ã†â€™Ãƒâ€ Ã¢â‚¬â„¢ÃƒÆ’Ã¢â‚¬Â ÃƒÂ¢Ã¢â€šÂ¬Ã¢â€žÂ¢ÃƒÆ’Ã†â€™ÃƒÂ¢Ã¢â€šÂ¬Ã‚Â ÃƒÆ’Ã‚Â¢ÃƒÂ¢Ã¢â‚¬Å¡Ã‚Â¬ÃƒÂ¢Ã¢â‚¬Å¾Ã‚Â¢ÃƒÆ’Ã†â€™Ãƒâ€ Ã¢â‚¬â„¢ÃƒÆ’Ã¢â‚¬Å¡Ãƒâ€šÃ‚Â¢ÃƒÆ’Ã†â€™Ãƒâ€šÃ‚Â¢ÃƒÆ’Ã‚Â¢ÃƒÂ¢Ã¢â‚¬Å¡Ã‚Â¬Ãƒâ€¦Ã‚Â¡ÃƒÆ’Ã¢â‚¬Å¡Ãƒâ€šÃ‚Â¬ÃƒÆ’Ã†â€™ÃƒÂ¢Ã¢â€šÂ¬Ã‚Â¦ÃƒÆ’Ã¢â‚¬Å¡Ãƒâ€šÃ‚Â¡ÃƒÆ’Ã†â€™Ãƒâ€ Ã¢â‚¬â„¢ÃƒÆ’Ã¢â‚¬Â ÃƒÂ¢Ã¢â€šÂ¬Ã¢â€žÂ¢ÃƒÆ’Ã†â€™Ãƒâ€šÃ‚Â¢ÃƒÆ’Ã‚Â¢ÃƒÂ¢Ã¢â€šÂ¬Ã…Â¡Ãƒâ€šÃ‚Â¬ÃƒÆ’Ã¢â‚¬Â¦Ãƒâ€šÃ‚Â¡ÃƒÆ’Ã†â€™Ãƒâ€ Ã¢â‚¬â„¢ÃƒÆ’Ã‚Â¢ÃƒÂ¢Ã¢â‚¬Å¡Ã‚Â¬Ãƒâ€¦Ã‚Â¡ÃƒÆ’Ã†â€™ÃƒÂ¢Ã¢â€šÂ¬Ã…Â¡ÃƒÆ’Ã¢â‚¬Å¡Ãƒâ€šÃ‚Â¬ÃƒÆ’Ã†â€™Ãƒâ€ Ã¢â‚¬â„¢ÃƒÆ’Ã¢â‚¬Â ÃƒÂ¢Ã¢â€šÂ¬Ã¢â€žÂ¢ÃƒÆ’Ã†â€™ÃƒÂ¢Ã¢â€šÂ¬Ã‚Â ÃƒÆ’Ã‚Â¢ÃƒÂ¢Ã¢â‚¬Å¡Ã‚Â¬ÃƒÂ¢Ã¢â‚¬Å¾Ã‚Â¢ÃƒÆ’Ã†â€™Ãƒâ€ Ã¢â‚¬â„¢ÃƒÆ’Ã‚Â¢ÃƒÂ¢Ã¢â‚¬Å¡Ã‚Â¬Ãƒâ€šÃ‚Â ÃƒÆ’Ã†â€™Ãƒâ€šÃ‚Â¢ÃƒÆ’Ã‚Â¢ÃƒÂ¢Ã¢â€šÂ¬Ã…Â¡Ãƒâ€šÃ‚Â¬ÃƒÆ’Ã‚Â¢ÃƒÂ¢Ã¢â€šÂ¬Ã…Â¾Ãƒâ€šÃ‚Â¢ÃƒÆ’Ã†â€™Ãƒâ€ Ã¢â‚¬â„¢ÃƒÆ’Ã¢â‚¬Â ÃƒÂ¢Ã¢â€šÂ¬Ã¢â€žÂ¢ÃƒÆ’Ã†â€™Ãƒâ€šÃ‚Â¢ÃƒÆ’Ã‚Â¢ÃƒÂ¢Ã¢â€šÂ¬Ã…Â¡Ãƒâ€šÃ‚Â¬ÃƒÆ’Ã¢â‚¬Â¦Ãƒâ€šÃ‚Â¡ÃƒÆ’Ã†â€™Ãƒâ€ Ã¢â‚¬â„¢ÃƒÆ’Ã‚Â¢ÃƒÂ¢Ã¢â‚¬Å¡Ã‚Â¬Ãƒâ€¦Ã‚Â¡ÃƒÆ’Ã†â€™ÃƒÂ¢Ã¢â€šÂ¬Ã…Â¡ÃƒÆ’Ã¢â‚¬Å¡Ãƒâ€šÃ‚Â¢ÃƒÆ’Ã†â€™Ãƒâ€ Ã¢â‚¬â„¢ÃƒÆ’Ã¢â‚¬Â ÃƒÂ¢Ã¢â€šÂ¬Ã¢â€žÂ¢ÃƒÆ’Ã†â€™ÃƒÂ¢Ã¢â€šÂ¬Ã‚Â ÃƒÆ’Ã‚Â¢ÃƒÂ¢Ã¢â‚¬Å¡Ã‚Â¬ÃƒÂ¢Ã¢â‚¬Å¾Ã‚Â¢ÃƒÆ’Ã†â€™Ãƒâ€ Ã¢â‚¬â„¢ÃƒÆ’Ã‚Â¢ÃƒÂ¢Ã¢â‚¬Å¡Ã‚Â¬Ãƒâ€¦Ã‚Â¡ÃƒÆ’Ã†â€™ÃƒÂ¢Ã¢â€šÂ¬Ã…Â¡ÃƒÆ’Ã¢â‚¬Å¡Ãƒâ€šÃ‚Â¢ÃƒÆ’Ã†â€™Ãƒâ€ Ã¢â‚¬â„¢ÃƒÆ’Ã¢â‚¬Â ÃƒÂ¢Ã¢â€šÂ¬Ã¢â€žÂ¢ÃƒÆ’Ã†â€™ÃƒÂ¢Ã¢â€šÂ¬Ã…Â¡ÃƒÆ’Ã¢â‚¬Å¡Ãƒâ€šÃ‚Â¢ÃƒÆ’Ã†â€™Ãƒâ€ Ã¢â‚¬â„¢ÃƒÆ’Ã¢â‚¬Å¡Ãƒâ€šÃ‚Â¢ÃƒÆ’Ã†â€™Ãƒâ€šÃ‚Â¢ÃƒÆ’Ã‚Â¢ÃƒÂ¢Ã¢â€šÂ¬Ã…Â¡Ãƒâ€šÃ‚Â¬ÃƒÆ’Ã¢â‚¬Â¦Ãƒâ€šÃ‚Â¡ÃƒÆ’Ã†â€™ÃƒÂ¢Ã¢â€šÂ¬Ã…Â¡ÃƒÆ’Ã¢â‚¬Å¡Ãƒâ€šÃ‚Â¬ÃƒÆ’Ã†â€™Ãƒâ€ Ã¢â‚¬â„¢ÃƒÆ’Ã‚Â¢ÃƒÂ¢Ã¢â‚¬Å¡Ã‚Â¬Ãƒâ€šÃ‚Â¦ÃƒÆ’Ã†â€™ÃƒÂ¢Ã¢â€šÂ¬Ã…Â¡ÃƒÆ’Ã¢â‚¬Å¡Ãƒâ€šÃ‚Â¡ÃƒÆ’Ã†â€™Ãƒâ€ Ã¢â‚¬â„¢ÃƒÆ’Ã¢â‚¬Â ÃƒÂ¢Ã¢â€šÂ¬Ã¢â€žÂ¢ÃƒÆ’Ã†â€™Ãƒâ€šÃ‚Â¢ÃƒÆ’Ã‚Â¢ÃƒÂ¢Ã¢â€šÂ¬Ã…Â¡Ãƒâ€šÃ‚Â¬ÃƒÆ’Ã¢â‚¬Â¦Ãƒâ€šÃ‚Â¡ÃƒÆ’Ã†â€™Ãƒâ€ Ã¢â‚¬â„¢ÃƒÆ’Ã‚Â¢ÃƒÂ¢Ã¢â‚¬Å¡Ã‚Â¬Ãƒâ€¦Ã‚Â¡ÃƒÆ’Ã†â€™ÃƒÂ¢Ã¢â€šÂ¬Ã…Â¡ÃƒÆ’Ã¢â‚¬Å¡Ãƒâ€šÃ‚Â¬ÃƒÆ’Ã†â€™Ãƒâ€ Ã¢â‚¬â„¢ÃƒÆ’Ã¢â‚¬Â ÃƒÂ¢Ã¢â€šÂ¬Ã¢â€žÂ¢ÃƒÆ’Ã†â€™ÃƒÂ¢Ã¢â€šÂ¬Ã‚Â ÃƒÆ’Ã‚Â¢ÃƒÂ¢Ã¢â‚¬Å¡Ã‚Â¬ÃƒÂ¢Ã¢â‚¬Å¾Ã‚Â¢ÃƒÆ’Ã†â€™Ãƒâ€ Ã¢â‚¬â„¢ÃƒÆ’Ã¢â‚¬Å¡Ãƒâ€šÃ‚Â¢ÃƒÆ’Ã†â€™Ãƒâ€šÃ‚Â¢ÃƒÆ’Ã‚Â¢ÃƒÂ¢Ã¢â‚¬Å¡Ã‚Â¬Ãƒâ€¦Ã‚Â¡ÃƒÆ’Ã¢â‚¬Å¡Ãƒâ€šÃ‚Â¬ÃƒÆ’Ã†â€™ÃƒÂ¢Ã¢â€šÂ¬Ã…Â¡ÃƒÆ’Ã¢â‚¬Å¡Ãƒâ€šÃ‚Â¦ÃƒÆ’Ã†â€™Ãƒâ€ Ã¢â‚¬â„¢ÃƒÆ’Ã¢â‚¬Â ÃƒÂ¢Ã¢â€šÂ¬Ã¢â€žÂ¢ÃƒÆ’Ã†â€™ÃƒÂ¢Ã¢â€šÂ¬Ã…Â¡ÃƒÆ’Ã¢â‚¬Å¡Ãƒâ€šÃ‚Â¢ÃƒÆ’Ã†â€™Ãƒâ€ Ã¢â‚¬â„¢ÃƒÆ’Ã¢â‚¬Å¡Ãƒâ€šÃ‚Â¢ÃƒÆ’Ã†â€™Ãƒâ€šÃ‚Â¢ÃƒÆ’Ã‚Â¢ÃƒÂ¢Ã¢â€šÂ¬Ã…Â¡Ãƒâ€šÃ‚Â¬ÃƒÆ’Ã¢â‚¬Â¦Ãƒâ€šÃ‚Â¡ÃƒÆ’Ã†â€™ÃƒÂ¢Ã¢â€šÂ¬Ã…Â¡ÃƒÆ’Ã¢â‚¬Å¡Ãƒâ€šÃ‚Â¬ÃƒÆ’Ã†â€™Ãƒâ€ Ã¢â‚¬â„¢ÃƒÆ’Ã‚Â¢ÃƒÂ¢Ã¢â‚¬Å¡Ã‚Â¬Ãƒâ€šÃ‚Â¦ÃƒÆ’Ã†â€™Ãƒâ€šÃ‚Â¢ÃƒÆ’Ã‚Â¢ÃƒÂ¢Ã¢â€šÂ¬Ã…Â¡Ãƒâ€šÃ‚Â¬ÃƒÆ’Ã¢â‚¬Â¦ÃƒÂ¢Ã¢â€šÂ¬Ã…â€œWk4), both systems recovered strongly, with Monoculture showing a slightly higher growth rate (3.227%/day) than IMTA (2.958%/day).</w:t>
+      </w:r>
+    </w:p>
+    <w:p>
+      <w:pPr>
+        <w:spacing w:line="360" w:lineRule="auto"/>
+        <w:rPr>
+          <w:rFonts w:ascii="Times New Roman" w:hAnsi="Times New Roman" w:cs="Times New Roman"/>
+        </w:rPr>
+      </w:pPr>
+      <w:r>
+        <w:rPr>
+          <w:rFonts w:ascii="Times New Roman" w:hAnsi="Times New Roman" w:cs="Times New Roman"/>
+        </w:rPr>
+        <w:t xml:space="preserve">A clear difference in stability is observed during the Wk4ÃƒÆ’Ã†â€™Ãƒâ€ Ã¢â‚¬â„¢ÃƒÆ’Ã¢â‚¬Â ÃƒÂ¢Ã¢â€šÂ¬Ã¢â€žÂ¢ÃƒÆ’Ã†â€™ÃƒÂ¢Ã¢â€šÂ¬Ã‚Â ÃƒÆ’Ã‚Â¢ÃƒÂ¢Ã¢â‚¬Å¡Ã‚Â¬ÃƒÂ¢Ã¢â‚¬Å¾Ã‚Â¢ÃƒÆ’Ã†â€™Ãƒâ€ Ã¢â‚¬â„¢ÃƒÆ’Ã‚Â¢ÃƒÂ¢Ã¢â‚¬Å¡Ã‚Â¬Ãƒâ€šÃ‚Â ÃƒÆ’Ã†â€™Ãƒâ€šÃ‚Â¢ÃƒÆ’Ã‚Â¢ÃƒÂ¢Ã¢â€šÂ¬Ã…Â¡Ãƒâ€šÃ‚Â¬ÃƒÆ’Ã‚Â¢ÃƒÂ¢Ã¢â€šÂ¬Ã…Â¾Ãƒâ€šÃ‚Â¢ÃƒÆ’Ã†â€™Ãƒâ€ Ã¢â‚¬â„¢ÃƒÆ’Ã¢â‚¬Â ÃƒÂ¢Ã¢â€šÂ¬Ã¢â€žÂ¢ÃƒÆ’Ã†â€™Ãƒâ€šÃ‚Â¢ÃƒÆ’Ã‚Â¢ÃƒÂ¢Ã¢â€šÂ¬Ã…Â¡Ãƒâ€šÃ‚Â¬ÃƒÆ’Ã¢â‚¬Å¡Ãƒâ€šÃ‚Â ÃƒÆ’Ã†â€™Ãƒâ€ Ã¢â‚¬â„¢ÃƒÆ’Ã¢â‚¬Å¡Ãƒâ€šÃ‚Â¢ÃƒÆ’Ã†â€™Ãƒâ€šÃ‚Â¢ÃƒÆ’Ã‚Â¢ÃƒÂ¢Ã¢â‚¬Å¡Ã‚Â¬Ãƒâ€¦Ã‚Â¡ÃƒÆ’Ã¢â‚¬Å¡Ãƒâ€šÃ‚Â¬ÃƒÆ’Ã†â€™Ãƒâ€šÃ‚Â¢ÃƒÆ’Ã‚Â¢ÃƒÂ¢Ã¢â‚¬Å¡Ã‚Â¬Ãƒâ€¦Ã‚Â¾ÃƒÆ’Ã¢â‚¬Å¡Ãƒâ€šÃ‚Â¢ÃƒÆ’Ã†â€™Ãƒâ€ Ã¢â‚¬â„¢ÃƒÆ’Ã¢â‚¬Â ÃƒÂ¢Ã¢â€šÂ¬Ã¢â€žÂ¢ÃƒÆ’Ã†â€™ÃƒÂ¢Ã¢â€šÂ¬Ã‚Â ÃƒÆ’Ã‚Â¢ÃƒÂ¢Ã¢â‚¬Å¡Ã‚Â¬ÃƒÂ¢Ã¢â‚¬Å¾Ã‚Â¢ÃƒÆ’Ã†â€™Ãƒâ€ Ã¢â‚¬â„¢ÃƒÆ’Ã¢â‚¬Å¡Ãƒâ€šÃ‚Â¢ÃƒÆ’Ã†â€™Ãƒâ€šÃ‚Â¢ÃƒÆ’Ã‚Â¢ÃƒÂ¢Ã¢â‚¬Å¡Ã‚Â¬Ãƒâ€¦Ã‚Â¡ÃƒÆ’Ã¢â‚¬Å¡Ãƒâ€šÃ‚Â¬ÃƒÆ’Ã†â€™ÃƒÂ¢Ã¢â€šÂ¬Ã‚Â¦ÃƒÆ’Ã¢â‚¬Å¡Ãƒâ€šÃ‚Â¡ÃƒÆ’Ã†â€™Ãƒâ€ Ã¢â‚¬â„¢ÃƒÆ’Ã¢â‚¬Â ÃƒÂ¢Ã¢â€šÂ¬Ã¢â€žÂ¢ÃƒÆ’Ã†â€™Ãƒâ€šÃ‚Â¢ÃƒÆ’Ã‚Â¢ÃƒÂ¢Ã¢â€šÂ¬Ã…Â¡Ãƒâ€šÃ‚Â¬ÃƒÆ’Ã¢â‚¬Â¦Ãƒâ€šÃ‚Â¡ÃƒÆ’Ã†â€™Ãƒâ€ Ã¢â‚¬â„¢ÃƒÆ’Ã‚Â¢ÃƒÂ¢Ã¢â‚¬Å¡Ã‚Â¬Ãƒâ€¦Ã‚Â¡ÃƒÆ’Ã†â€™ÃƒÂ¢Ã¢â€šÂ¬Ã…Â¡ÃƒÆ’Ã¢â‚¬Å¡Ãƒâ€šÃ‚Â¢ÃƒÆ’Ã†â€™Ãƒâ€ Ã¢â‚¬â„¢ÃƒÆ’Ã¢â‚¬Â ÃƒÂ¢Ã¢â€šÂ¬Ã¢â€žÂ¢ÃƒÆ’Ã†â€™ÃƒÂ¢Ã¢â€šÂ¬Ã‚Â ÃƒÆ’Ã‚Â¢ÃƒÂ¢Ã¢â‚¬Å¡Ã‚Â¬ÃƒÂ¢Ã¢â‚¬Å¾Ã‚Â¢ÃƒÆ’Ã†â€™Ãƒâ€ Ã¢â‚¬â„¢ÃƒÆ’Ã‚Â¢ÃƒÂ¢Ã¢â‚¬Å¡Ã‚Â¬Ãƒâ€šÃ‚Â ÃƒÆ’Ã†â€™Ãƒâ€šÃ‚Â¢ÃƒÆ’Ã‚Â¢ÃƒÂ¢Ã¢â€šÂ¬Ã…Â¡Ãƒâ€šÃ‚Â¬ÃƒÆ’Ã‚Â¢ÃƒÂ¢Ã¢â€šÂ¬Ã…Â¾Ãƒâ€šÃ‚Â¢ÃƒÆ’Ã†â€™Ãƒâ€ Ã¢â‚¬â„¢ÃƒÆ’Ã¢â‚¬Â ÃƒÂ¢Ã¢â€šÂ¬Ã¢â€žÂ¢ÃƒÆ’Ã†â€™Ãƒâ€šÃ‚Â¢ÃƒÆ’Ã‚Â¢ÃƒÂ¢Ã¢â€šÂ¬Ã…Â¡Ãƒâ€šÃ‚Â¬ÃƒÆ’Ã¢â‚¬Â¦Ãƒâ€šÃ‚Â¡ÃƒÆ’Ã†â€™Ãƒâ€ Ã¢â‚¬â„¢ÃƒÆ’Ã‚Â¢ÃƒÂ¢Ã¢â‚¬Å¡Ã‚Â¬Ãƒâ€¦Ã‚Â¡ÃƒÆ’Ã†â€™ÃƒÂ¢Ã¢â€šÂ¬Ã…Â¡ÃƒÆ’Ã¢â‚¬Å¡Ãƒâ€šÃ‚Â¢ÃƒÆ’Ã†â€™Ãƒâ€ Ã¢â‚¬â„¢ÃƒÆ’Ã¢â‚¬Â ÃƒÂ¢Ã¢â€šÂ¬Ã¢â€žÂ¢ÃƒÆ’Ã†â€™ÃƒÂ¢Ã¢â€šÂ¬Ã‚Â ÃƒÆ’Ã‚Â¢ÃƒÂ¢Ã¢â‚¬Å¡Ã‚Â¬ÃƒÂ¢Ã¢â‚¬Å¾Ã‚Â¢ÃƒÆ’Ã†â€™Ãƒâ€ Ã¢â‚¬â„¢ÃƒÆ’Ã‚Â¢ÃƒÂ¢Ã¢â‚¬Å¡Ã‚Â¬Ãƒâ€¦Ã‚Â¡ÃƒÆ’Ã†â€™ÃƒÂ¢Ã¢â€šÂ¬Ã…Â¡ÃƒÆ’Ã¢â‚¬Å¡Ãƒâ€šÃ‚Â¢ÃƒÆ’Ã†â€™Ãƒâ€ Ã¢â‚¬â„¢ÃƒÆ’Ã¢â‚¬Â ÃƒÂ¢Ã¢â€šÂ¬Ã¢â€žÂ¢ÃƒÆ’Ã†â€™ÃƒÂ¢Ã¢â€šÂ¬Ã…Â¡ÃƒÆ’Ã¢â‚¬Å¡Ãƒâ€šÃ‚Â¢ÃƒÆ’Ã†â€™Ãƒâ€ Ã¢â‚¬â„¢ÃƒÆ’Ã¢â‚¬Å¡Ãƒâ€šÃ‚Â¢ÃƒÆ’Ã†â€™Ãƒâ€šÃ‚Â¢ÃƒÆ’Ã‚Â¢ÃƒÂ¢Ã¢â‚¬Å¡Ã‚Â¬Ãƒâ€¦Ã‚Â¡ÃƒÆ’Ã¢â‚¬Å¡Ãƒâ€šÃ‚Â¬ÃƒÆ’Ã†â€™ÃƒÂ¢Ã¢â€šÂ¬Ã‚Â¦ÃƒÆ’Ã¢â‚¬Å¡Ãƒâ€šÃ‚Â¡ÃƒÆ’Ã†â€™Ãƒâ€ Ã¢â‚¬â„¢ÃƒÆ’Ã‚Â¢ÃƒÂ¢Ã¢â‚¬Å¡Ã‚Â¬Ãƒâ€¦Ã‚Â¡ÃƒÆ’Ã†â€™ÃƒÂ¢Ã¢â€šÂ¬Ã…Â¡ÃƒÆ’Ã¢â‚¬Å¡Ãƒâ€šÃ‚Â¬ÃƒÆ’Ã†â€™Ãƒâ€ Ã¢â‚¬â„¢ÃƒÆ’Ã¢â‚¬Â ÃƒÂ¢Ã¢â€šÂ¬Ã¢â€žÂ¢ÃƒÆ’Ã†â€™Ãƒâ€šÃ‚Â¢ÃƒÆ’Ã‚Â¢ÃƒÂ¢Ã¢â€šÂ¬Ã…Â¡Ãƒâ€šÃ‚Â¬ÃƒÆ’Ã¢â‚¬Å¡Ãƒâ€šÃ‚Â¦ÃƒÆ’Ã†â€™Ãƒâ€ Ã¢â‚¬â„¢ÃƒÆ’Ã‚Â¢ÃƒÂ¢Ã¢â‚¬Å¡Ã‚Â¬Ãƒâ€¦Ã‚Â¡ÃƒÆ’Ã†â€™ÃƒÂ¢Ã¢â€šÂ¬Ã…Â¡ÃƒÆ’Ã¢â‚¬Å¡Ãƒâ€šÃ‚Â¡ÃƒÆ’Ã†â€™Ãƒâ€ Ã¢â‚¬â„¢ÃƒÆ’Ã¢â‚¬Â ÃƒÂ¢Ã¢â€šÂ¬Ã¢â€žÂ¢ÃƒÆ’Ã†â€™ÃƒÂ¢Ã¢â€šÂ¬Ã‚Â ÃƒÆ’Ã‚Â¢ÃƒÂ¢Ã¢â‚¬Å¡Ã‚Â¬ÃƒÂ¢Ã¢â‚¬Å¾Ã‚Â¢ÃƒÆ’Ã†â€™Ãƒâ€ Ã¢â‚¬â„¢ÃƒÆ’Ã¢â‚¬Å¡Ãƒâ€šÃ‚Â¢ÃƒÆ’Ã†â€™Ãƒâ€šÃ‚Â¢ÃƒÆ’Ã‚Â¢ÃƒÂ¢Ã¢â‚¬Å¡Ã‚Â¬Ãƒâ€¦Ã‚Â¡ÃƒÆ’Ã¢â‚¬Å¡Ãƒâ€šÃ‚Â¬ÃƒÆ’Ã†â€™ÃƒÂ¢Ã¢â€šÂ¬Ã‚Â¦ÃƒÆ’Ã¢â‚¬Å¡Ãƒâ€šÃ‚Â¡ÃƒÆ’Ã†â€™Ãƒâ€ Ã¢â‚¬â„¢ÃƒÆ’Ã¢â‚¬Â ÃƒÂ¢Ã¢â€šÂ¬Ã¢â€žÂ¢ÃƒÆ’Ã†â€™Ãƒâ€šÃ‚Â¢ÃƒÆ’Ã‚Â¢ÃƒÂ¢Ã¢â€šÂ¬Ã…Â¡Ãƒâ€šÃ‚Â¬ÃƒÆ’Ã¢â‚¬Â¦Ãƒâ€šÃ‚Â¡ÃƒÆ’Ã†â€™Ãƒâ€ Ã¢â‚¬â„¢ÃƒÆ’Ã‚Â¢ÃƒÂ¢Ã¢â‚¬Å¡Ã‚Â¬Ãƒâ€¦Ã‚Â¡ÃƒÆ’Ã†â€™ÃƒÂ¢Ã¢â€šÂ¬Ã…Â¡ÃƒÆ’Ã¢â‚¬Å¡Ãƒâ€šÃ‚Â¬ÃƒÆ’Ã†â€™Ãƒâ€ Ã¢â‚¬â„¢ÃƒÆ’Ã¢â‚¬Â ÃƒÂ¢Ã¢â€šÂ¬Ã¢â€žÂ¢ÃƒÆ’Ã†â€™ÃƒÂ¢Ã¢â€šÂ¬Ã‚Â ÃƒÆ’Ã‚Â¢ÃƒÂ¢Ã¢â‚¬Å¡Ã‚Â¬ÃƒÂ¢Ã¢â‚¬Å¾Ã‚Â¢ÃƒÆ’Ã†â€™Ãƒâ€ Ã¢â‚¬â„¢ÃƒÆ’Ã‚Â¢ÃƒÂ¢Ã¢â‚¬Å¡Ã‚Â¬Ãƒâ€šÃ‚Â ÃƒÆ’Ã†â€™Ãƒâ€šÃ‚Â¢ÃƒÆ’Ã‚Â¢ÃƒÂ¢Ã¢â€šÂ¬Ã…Â¡Ãƒâ€šÃ‚Â¬ÃƒÆ’Ã‚Â¢ÃƒÂ¢Ã¢â€šÂ¬Ã…Â¾Ãƒâ€šÃ‚Â¢ÃƒÆ’Ã†â€™Ãƒâ€ Ã¢â‚¬â„¢ÃƒÆ’Ã¢â‚¬Â ÃƒÂ¢Ã¢â€šÂ¬Ã¢â€žÂ¢ÃƒÆ’Ã†â€™Ãƒâ€šÃ‚Â¢ÃƒÆ’Ã‚Â¢ÃƒÂ¢Ã¢â€šÂ¬Ã…Â¡Ãƒâ€šÃ‚Â¬ÃƒÆ’Ã¢â‚¬Â¦Ãƒâ€šÃ‚Â¡ÃƒÆ’Ã†â€™Ãƒâ€ Ã¢â‚¬â„¢ÃƒÆ’Ã‚Â¢ÃƒÂ¢Ã¢â‚¬Å¡Ã‚Â¬Ãƒâ€¦Ã‚Â¡ÃƒÆ’Ã†â€™ÃƒÂ¢Ã¢â€šÂ¬Ã…Â¡ÃƒÆ’Ã¢â‚¬Å¡Ãƒâ€šÃ‚Â¢ÃƒÆ’Ã†â€™Ãƒâ€ Ã¢â‚¬â„¢ÃƒÆ’Ã¢â‚¬Â ÃƒÂ¢Ã¢â€šÂ¬Ã¢â€žÂ¢ÃƒÆ’Ã†â€™ÃƒÂ¢Ã¢â€šÂ¬Ã‚Â ÃƒÆ’Ã‚Â¢ÃƒÂ¢Ã¢â‚¬Å¡Ã‚Â¬ÃƒÂ¢Ã¢â‚¬Å¾Ã‚Â¢ÃƒÆ’Ã†â€™Ãƒâ€ Ã¢â‚¬â„¢ÃƒÆ’Ã‚Â¢ÃƒÂ¢Ã¢â‚¬Å¡Ã‚Â¬Ãƒâ€¦Ã‚Â¡ÃƒÆ’Ã†â€™ÃƒÂ¢Ã¢â€šÂ¬Ã…Â¡ÃƒÆ’Ã¢â‚¬Å¡Ãƒâ€šÃ‚Â¢ÃƒÆ’Ã†â€™Ãƒâ€ Ã¢â‚¬â„¢ÃƒÆ’Ã¢â‚¬Â ÃƒÂ¢Ã¢â€šÂ¬Ã¢â€žÂ¢ÃƒÆ’Ã†â€™ÃƒÂ¢Ã¢â€šÂ¬Ã…Â¡ÃƒÆ’Ã¢â‚¬Å¡Ãƒâ€šÃ‚Â¢ÃƒÆ’Ã†â€™Ãƒâ€ Ã¢â‚¬â„¢ÃƒÆ’Ã¢â‚¬Å¡Ãƒâ€šÃ‚Â¢ÃƒÆ’Ã†â€™Ãƒâ€šÃ‚Â¢ÃƒÆ’Ã‚Â¢ÃƒÂ¢Ã¢â€šÂ¬Ã…Â¡Ãƒâ€šÃ‚Â¬ÃƒÆ’Ã¢â‚¬Â¦Ãƒâ€šÃ‚Â¡ÃƒÆ’Ã†â€™ÃƒÂ¢Ã¢â€šÂ¬Ã…Â¡ÃƒÆ’Ã¢â‚¬Å¡Ãƒâ€šÃ‚Â¬ÃƒÆ’Ã†â€™Ãƒâ€ Ã¢â‚¬â„¢ÃƒÆ’Ã‚Â¢ÃƒÂ¢Ã¢â‚¬Å¡Ã‚Â¬Ãƒâ€šÃ‚Â¦ÃƒÆ’Ã†â€™ÃƒÂ¢Ã¢â€šÂ¬Ã…Â¡ÃƒÆ’Ã¢â‚¬Å¡Ãƒâ€šÃ‚Â¡ÃƒÆ’Ã†â€™Ãƒâ€ Ã¢â‚¬â„¢ÃƒÆ’Ã¢â‚¬Â ÃƒÂ¢Ã¢â€šÂ¬Ã¢â€žÂ¢ÃƒÆ’Ã†â€™Ãƒâ€šÃ‚Â¢ÃƒÆ’Ã‚Â¢ÃƒÂ¢Ã¢â€šÂ¬Ã…Â¡Ãƒâ€šÃ‚Â¬ÃƒÆ’Ã¢â‚¬Â¦Ãƒâ€šÃ‚Â¡ÃƒÆ’Ã†â€™Ãƒâ€ Ã¢â‚¬â„¢ÃƒÆ’Ã‚Â¢ÃƒÂ¢Ã¢â‚¬Å¡Ã‚Â¬Ãƒâ€¦Ã‚Â¡ÃƒÆ’Ã†â€™ÃƒÂ¢Ã¢â€šÂ¬Ã…Â¡ÃƒÆ’Ã¢â‚¬Å¡Ãƒâ€šÃ‚Â¬ÃƒÆ’Ã†â€™Ãƒâ€ Ã¢â‚¬â„¢ÃƒÆ’Ã¢â‚¬Â ÃƒÂ¢Ã¢â€šÂ¬Ã¢â€žÂ¢ÃƒÆ’Ã†â€™ÃƒÂ¢Ã¢â€šÂ¬Ã‚Â ÃƒÆ’Ã‚Â¢ÃƒÂ¢Ã¢â‚¬Å¡Ã‚Â¬ÃƒÂ¢Ã¢â‚¬Å¾Ã‚Â¢ÃƒÆ’Ã†â€™Ãƒâ€ Ã¢â‚¬â„¢ÃƒÆ’Ã¢â‚¬Å¡Ãƒâ€šÃ‚Â¢ÃƒÆ’Ã†â€™Ãƒâ€šÃ‚Â¢ÃƒÆ’Ã‚Â¢ÃƒÂ¢Ã¢â‚¬Å¡Ã‚Â¬Ãƒâ€¦Ã‚Â¡ÃƒÆ’Ã¢â‚¬Å¡Ãƒâ€šÃ‚Â¬ÃƒÆ’Ã†â€™ÃƒÂ¢Ã¢â€šÂ¬Ã…Â¡ÃƒÆ’Ã¢â‚¬Å¡Ãƒâ€šÃ‚Â¦ÃƒÆ’Ã†â€™Ãƒâ€ Ã¢â‚¬â„¢ÃƒÆ’Ã¢â‚¬Â ÃƒÂ¢Ã¢â€šÂ¬Ã¢â€žÂ¢ÃƒÆ’Ã†â€™ÃƒÂ¢Ã¢â€šÂ¬Ã…Â¡ÃƒÆ’Ã¢â‚¬Å¡Ãƒâ€šÃ‚Â¢ÃƒÆ’Ã†â€™Ãƒâ€ Ã¢â‚¬â„¢ÃƒÆ’Ã¢â‚¬Å¡Ãƒâ€šÃ‚Â¢ÃƒÆ’Ã†â€™Ãƒâ€šÃ‚Â¢ÃƒÆ’Ã‚Â¢ÃƒÂ¢Ã¢â€šÂ¬Ã…Â¡Ãƒâ€šÃ‚Â¬ÃƒÆ’Ã¢â‚¬Â¦Ãƒâ€šÃ‚Â¡ÃƒÆ’Ã†â€™ÃƒÂ¢Ã¢â€šÂ¬Ã…Â¡ÃƒÆ’Ã¢â‚¬Å¡Ãƒâ€šÃ‚Â¬ÃƒÆ’Ã†â€™Ãƒâ€ Ã¢â‚¬â„¢ÃƒÆ’Ã‚Â¢ÃƒÂ¢Ã¢â‚¬Å¡Ã‚Â¬Ãƒâ€šÃ‚Â¦ÃƒÆ’Ã†â€™Ãƒâ€šÃ‚Â¢ÃƒÆ’Ã‚Â¢ÃƒÂ¢Ã¢â€šÂ¬Ã…Â¡Ãƒâ€šÃ‚Â¬ÃƒÆ’Ã¢â‚¬Â¦ÃƒÂ¢Ã¢â€šÂ¬Ã…â€œWk5 interval, where the IMTA system remained relatively stable with a minor decline (-0.668%/day), while the Monoculture system experienced a sharp drop in growth (-9.516%/day), indicating strong physiological stress. In the final phase (Wk5ÃƒÆ’Ã†â€™Ãƒâ€ Ã¢â‚¬â„¢ÃƒÆ’Ã¢â‚¬Â ÃƒÂ¢Ã¢â€šÂ¬Ã¢â€žÂ¢ÃƒÆ’Ã†â€™ÃƒÂ¢Ã¢â€šÂ¬Ã‚Â ÃƒÆ’Ã‚Â¢ÃƒÂ¢Ã¢â‚¬Å¡Ã‚Â¬ÃƒÂ¢Ã¢â‚¬Å¾Ã‚Â¢ÃƒÆ’Ã†â€™Ãƒâ€ Ã¢â‚¬â„¢ÃƒÆ’Ã‚Â¢ÃƒÂ¢Ã¢â‚¬Å¡Ã‚Â¬Ãƒâ€šÃ‚Â ÃƒÆ’Ã†â€™Ãƒâ€šÃ‚Â¢ÃƒÆ’Ã‚Â¢ÃƒÂ¢Ã¢â€šÂ¬Ã…Â¡Ãƒâ€šÃ‚Â¬ÃƒÆ’Ã‚Â¢ÃƒÂ¢Ã¢â€šÂ¬Ã…Â¾Ãƒâ€šÃ‚Â¢ÃƒÆ’Ã†â€™Ãƒâ€ Ã¢â‚¬â„¢ÃƒÆ’Ã¢â‚¬Â ÃƒÂ¢Ã¢â€šÂ¬Ã¢â€žÂ¢ÃƒÆ’Ã†â€™Ãƒâ€šÃ‚Â¢ÃƒÆ’Ã‚Â¢ÃƒÂ¢Ã¢â€šÂ¬Ã…Â¡Ãƒâ€šÃ‚Â¬ÃƒÆ’Ã¢â‚¬Å¡Ãƒâ€šÃ‚Â ÃƒÆ’Ã†â€™Ãƒâ€ Ã¢â‚¬â„¢ÃƒÆ’Ã¢â‚¬Å¡Ãƒâ€šÃ‚Â¢ÃƒÆ’Ã†â€™Ãƒâ€šÃ‚Â¢ÃƒÆ’Ã‚Â¢ÃƒÂ¢Ã¢â‚¬Å¡Ã‚Â¬Ãƒâ€¦Ã‚Â¡ÃƒÆ’Ã¢â‚¬Å¡Ãƒâ€šÃ‚Â¬ÃƒÆ’Ã†â€™Ãƒâ€šÃ‚Â¢ÃƒÆ’Ã‚Â¢ÃƒÂ¢Ã¢â‚¬Å¡Ã‚Â¬Ãƒâ€¦Ã‚Â¾ÃƒÆ’Ã¢â‚¬Å¡Ãƒâ€šÃ‚Â¢ÃƒÆ’Ã†â€™Ãƒâ€ Ã¢â‚¬â„¢ÃƒÆ’Ã¢â‚¬Â ÃƒÂ¢Ã¢â€šÂ¬Ã¢â€žÂ¢ÃƒÆ’Ã†â€™ÃƒÂ¢Ã¢â€šÂ¬Ã‚Â ÃƒÆ’Ã‚Â¢ÃƒÂ¢Ã¢â‚¬Å¡Ã‚Â¬ÃƒÂ¢Ã¢â‚¬Å¾Ã‚Â¢ÃƒÆ’Ã†â€™Ãƒâ€ Ã¢â‚¬â„¢ÃƒÆ’Ã¢â‚¬Å¡Ãƒâ€šÃ‚Â¢ÃƒÆ’Ã†â€™Ãƒâ€šÃ‚Â¢ÃƒÆ’Ã‚Â¢ÃƒÂ¢Ã¢â‚¬Å¡Ã‚Â¬Ãƒâ€¦Ã‚Â¡ÃƒÆ’Ã¢â‚¬Å¡Ãƒâ€šÃ‚Â¬ÃƒÆ’Ã†â€™ÃƒÂ¢Ã¢â€šÂ¬Ã‚Â¦ÃƒÆ’Ã¢â‚¬Å¡Ãƒâ€šÃ‚Â¡ÃƒÆ’Ã†â€™Ãƒâ€ Ã¢â‚¬â„¢ÃƒÆ’Ã¢â‚¬Â ÃƒÂ¢Ã¢â€šÂ¬Ã¢â€žÂ¢ÃƒÆ’Ã†â€™Ãƒâ€šÃ‚Â¢ÃƒÆ’Ã‚Â¢ÃƒÂ¢Ã¢â€šÂ¬Ã…Â¡Ãƒâ€šÃ‚Â¬ÃƒÆ’Ã¢â‚¬Â¦Ãƒâ€šÃ‚Â¡ÃƒÆ’Ã†â€™Ãƒâ€ Ã¢â‚¬â„¢ÃƒÆ’Ã‚Â¢ÃƒÂ¢Ã¢â‚¬Å¡Ã‚Â¬Ãƒâ€¦Ã‚Â¡ÃƒÆ’Ã†â€™ÃƒÂ¢Ã¢â€šÂ¬Ã…Â¡ÃƒÆ’Ã¢â‚¬Å¡Ãƒâ€šÃ‚Â¢ÃƒÆ’Ã†â€™Ãƒâ€ Ã¢â‚¬â„¢ÃƒÆ’Ã¢â‚¬Â ÃƒÂ¢Ã¢â€šÂ¬Ã¢â€žÂ¢ÃƒÆ’Ã†â€™ÃƒÂ¢Ã¢â€šÂ¬Ã‚Â ÃƒÆ’Ã‚Â¢ÃƒÂ¢Ã¢â‚¬Å¡Ã‚Â¬ÃƒÂ¢Ã¢â‚¬Å¾Ã‚Â¢ÃƒÆ’Ã†â€™Ãƒâ€ Ã¢â‚¬â„¢ÃƒÆ’Ã‚Â¢ÃƒÂ¢Ã¢â‚¬Å¡Ã‚Â¬Ãƒâ€šÃ‚Â ÃƒÆ’Ã†â€™Ãƒâ€šÃ‚Â¢ÃƒÆ’Ã‚Â¢ÃƒÂ¢Ã¢â€šÂ¬Ã…Â¡Ãƒâ€šÃ‚Â¬ÃƒÆ’Ã‚Â¢ÃƒÂ¢Ã¢â€šÂ¬Ã…Â¾Ãƒâ€šÃ‚Â¢ÃƒÆ’Ã†â€™Ãƒâ€ Ã¢â‚¬â„¢ÃƒÆ’Ã¢â‚¬Â ÃƒÂ¢Ã¢â€šÂ¬Ã¢â€žÂ¢ÃƒÆ’Ã†â€™Ãƒâ€šÃ‚Â¢ÃƒÆ’Ã‚Â¢ÃƒÂ¢Ã¢â€šÂ¬Ã…Â¡Ãƒâ€šÃ‚Â¬ÃƒÆ’Ã¢â‚¬Â¦Ãƒâ€šÃ‚Â¡ÃƒÆ’Ã†â€™Ãƒâ€ Ã¢â‚¬â„¢ÃƒÆ’Ã‚Â¢ÃƒÂ¢Ã¢â‚¬Å¡Ã‚Â¬Ãƒâ€¦Ã‚Â¡ÃƒÆ’Ã†â€™ÃƒÂ¢Ã¢â€šÂ¬Ã…Â¡ÃƒÆ’Ã¢â‚¬Å¡Ãƒâ€šÃ‚Â¢ÃƒÆ’Ã†â€™Ãƒâ€ Ã¢â‚¬â„¢ÃƒÆ’Ã¢â‚¬Â ÃƒÂ¢Ã¢â€šÂ¬Ã¢â€žÂ¢ÃƒÆ’Ã†â€™ÃƒÂ¢Ã¢â€šÂ¬Ã‚Â ÃƒÆ’Ã‚Â¢ÃƒÂ¢Ã¢â‚¬Å¡Ã‚Â¬ÃƒÂ¢Ã¢â‚¬Å¾Ã‚Â¢ÃƒÆ’Ã†â€™Ãƒâ€ Ã¢â‚¬â„¢ÃƒÆ’Ã‚Â¢ÃƒÂ¢Ã¢â‚¬Å¡Ã‚Â¬Ãƒâ€¦Ã‚Â¡ÃƒÆ’Ã†â€™ÃƒÂ¢Ã¢â€šÂ¬Ã…Â¡ÃƒÆ’Ã¢â‚¬Å¡Ãƒâ€šÃ‚Â¢ÃƒÆ’Ã†â€™Ãƒâ€ Ã¢â‚¬â„¢ÃƒÆ’Ã¢â‚¬Â ÃƒÂ¢Ã¢â€šÂ¬Ã¢â€žÂ¢ÃƒÆ’Ã†â€™ÃƒÂ¢Ã¢â€šÂ¬Ã…Â¡ÃƒÆ’Ã¢â‚¬Å¡Ãƒâ€šÃ‚Â¢ÃƒÆ’Ã†â€™Ãƒâ€ Ã¢â‚¬â„¢ÃƒÆ’Ã¢â‚¬Å¡Ãƒâ€šÃ‚Â¢ÃƒÆ’Ã†â€™Ãƒâ€šÃ‚Â¢ÃƒÆ’Ã‚Â¢ÃƒÂ¢Ã¢â‚¬Å¡Ã‚Â¬Ãƒâ€¦Ã‚Â¡ÃƒÆ’Ã¢â‚¬Å¡Ãƒâ€šÃ‚Â¬ÃƒÆ’Ã†â€™ÃƒÂ¢Ã¢â€šÂ¬Ã‚Â¦ÃƒÆ’Ã¢â‚¬Å¡Ãƒâ€šÃ‚Â¡ÃƒÆ’Ã†â€™Ãƒâ€ Ã¢â‚¬â„¢ÃƒÆ’Ã‚Â¢ÃƒÂ¢Ã¢â‚¬Å¡Ã‚Â¬Ãƒâ€¦Ã‚Â¡ÃƒÆ’Ã†â€™ÃƒÂ¢Ã¢â€šÂ¬Ã…Â¡ÃƒÆ’Ã¢â‚¬Å¡Ãƒâ€šÃ‚Â¬ÃƒÆ’Ã†â€™Ãƒâ€ Ã¢â‚¬â„¢ÃƒÆ’Ã¢â‚¬Â ÃƒÂ¢Ã¢â€šÂ¬Ã¢â€žÂ¢ÃƒÆ’Ã†â€™Ãƒâ€šÃ‚Â¢ÃƒÆ’Ã‚Â¢ÃƒÂ¢Ã¢â€šÂ¬Ã…Â¡Ãƒâ€šÃ‚Â¬ÃƒÆ’Ã¢â‚¬Å¡Ãƒâ€šÃ‚Â¦ÃƒÆ’Ã†â€™Ãƒâ€ Ã¢â‚¬â„¢ÃƒÆ’Ã‚Â¢ÃƒÂ¢Ã¢â‚¬Å¡Ã‚Â¬Ãƒâ€¦Ã‚Â¡ÃƒÆ’Ã†â€™ÃƒÂ¢Ã¢â€šÂ¬Ã…Â¡ÃƒÆ’Ã¢â‚¬Å¡Ãƒâ€šÃ‚Â¡ÃƒÆ’Ã†â€™Ãƒâ€ Ã¢â‚¬â„¢ÃƒÆ’Ã¢â‚¬Â ÃƒÂ¢Ã¢â€šÂ¬Ã¢â€žÂ¢ÃƒÆ’Ã†â€™ÃƒÂ¢Ã¢â€šÂ¬Ã‚Â ÃƒÆ’Ã‚Â¢ÃƒÂ¢Ã¢â‚¬Å¡Ã‚Â¬ÃƒÂ¢Ã¢â‚¬Å¾Ã‚Â¢ÃƒÆ’Ã†â€™Ãƒâ€ Ã¢â‚¬â„¢ÃƒÆ’Ã¢â‚¬Å¡Ãƒâ€šÃ‚Â¢ÃƒÆ’Ã†â€™Ãƒâ€šÃ‚Â¢ÃƒÆ’Ã‚Â¢ÃƒÂ¢Ã¢â‚¬Å¡Ã‚Â¬Ãƒâ€¦Ã‚Â¡ÃƒÆ’Ã¢â‚¬Å¡Ãƒâ€šÃ‚Â¬ÃƒÆ’Ã†â€™ÃƒÂ¢Ã¢â€šÂ¬Ã‚Â¦ÃƒÆ’Ã¢â‚¬Å¡Ãƒâ€šÃ‚Â¡ÃƒÆ’Ã†â€™Ãƒâ€ Ã¢â‚¬â„¢ÃƒÆ’Ã¢â‚¬Â ÃƒÂ¢Ã¢â€šÂ¬Ã¢â€žÂ¢ÃƒÆ’Ã†â€™Ãƒâ€šÃ‚Â¢ÃƒÆ’Ã‚Â¢ÃƒÂ¢Ã¢â€šÂ¬Ã…Â¡Ãƒâ€šÃ‚Â¬ÃƒÆ’Ã¢â‚¬Â¦Ãƒâ€šÃ‚Â¡ÃƒÆ’Ã†â€™Ãƒâ€ Ã¢â‚¬â„¢ÃƒÆ’Ã‚Â¢ÃƒÂ¢Ã¢â‚¬Å¡Ã‚Â¬Ãƒâ€¦Ã‚Â¡ÃƒÆ’Ã†â€™ÃƒÂ¢Ã¢â€šÂ¬Ã…Â¡ÃƒÆ’Ã¢â‚¬Å¡Ãƒâ€šÃ‚Â¬ÃƒÆ’Ã†â€™Ãƒâ€ Ã¢â‚¬â„¢ÃƒÆ’Ã¢â‚¬Â ÃƒÂ¢Ã¢â€šÂ¬Ã¢â€žÂ¢ÃƒÆ’Ã†â€™ÃƒÂ¢Ã¢â€šÂ¬Ã‚Â ÃƒÆ’Ã‚Â¢ÃƒÂ¢Ã¢â‚¬Å¡Ã‚Â¬ÃƒÂ¢Ã¢â‚¬Å¾Ã‚Â¢ÃƒÆ’Ã†â€™Ãƒâ€ Ã¢â‚¬â„¢ÃƒÆ’Ã‚Â¢ÃƒÂ¢Ã¢â‚¬Å¡Ã‚Â¬Ãƒâ€šÃ‚Â ÃƒÆ’Ã†â€™Ãƒâ€šÃ‚Â¢ÃƒÆ’Ã‚Â¢ÃƒÂ¢Ã¢â€šÂ¬Ã…Â¡Ãƒâ€šÃ‚Â¬ÃƒÆ’Ã‚Â¢ÃƒÂ¢Ã¢â€šÂ¬Ã…Â¾Ãƒâ€šÃ‚Â¢ÃƒÆ’Ã†â€™Ãƒâ€ Ã¢â‚¬â„¢ÃƒÆ’Ã¢â‚¬Â ÃƒÂ¢Ã¢â€šÂ¬Ã¢â€žÂ¢ÃƒÆ’Ã†â€™Ãƒâ€šÃ‚Â¢ÃƒÆ’Ã‚Â¢ÃƒÂ¢Ã¢â€šÂ¬Ã…Â¡Ãƒâ€šÃ‚Â¬ÃƒÆ’Ã¢â‚¬Â¦Ãƒâ€šÃ‚Â¡ÃƒÆ’Ã†â€™Ãƒâ€ Ã¢â‚¬â„¢ÃƒÆ’Ã‚Â¢ÃƒÂ¢Ã¢â‚¬Å¡Ã‚Â¬Ãƒâ€¦Ã‚Â¡ÃƒÆ’Ã†â€™ÃƒÂ¢Ã¢â€šÂ¬Ã…Â¡ÃƒÆ’Ã¢â‚¬Å¡Ãƒâ€šÃ‚Â¢ÃƒÆ’Ã†â€™Ãƒâ€ Ã¢â‚¬â„¢ÃƒÆ’Ã¢â‚¬Â ÃƒÂ¢Ã¢â€šÂ¬Ã¢â€žÂ¢ÃƒÆ’Ã†â€™ÃƒÂ¢Ã¢â€šÂ¬Ã‚Â ÃƒÆ’Ã‚Â¢ÃƒÂ¢Ã¢â‚¬Å¡Ã‚Â¬ÃƒÂ¢Ã¢â‚¬Å¾Ã‚Â¢ÃƒÆ’Ã†â€™Ãƒâ€ Ã¢â‚¬â„¢ÃƒÆ’Ã‚Â¢ÃƒÂ¢Ã¢â‚¬Å¡Ã‚Â¬Ãƒâ€¦Ã‚Â¡ÃƒÆ’Ã†â€™ÃƒÂ¢Ã¢â€šÂ¬Ã…Â¡ÃƒÆ’Ã¢â‚¬Å¡Ãƒâ€šÃ‚Â¢ÃƒÆ’Ã†â€™Ãƒâ€ Ã¢â‚¬â„¢ÃƒÆ’Ã¢â‚¬Â ÃƒÂ¢Ã¢â€šÂ¬Ã¢â€žÂ¢ÃƒÆ’Ã†â€™ÃƒÂ¢Ã¢â€šÂ¬Ã…Â¡ÃƒÆ’Ã¢â‚¬Å¡Ãƒâ€šÃ‚Â¢ÃƒÆ’Ã†â€™Ãƒâ€ Ã¢â‚¬â„¢ÃƒÆ’Ã¢â‚¬Å¡Ãƒâ€šÃ‚Â¢ÃƒÆ’Ã†â€™Ãƒâ€šÃ‚Â¢ÃƒÆ’Ã‚Â¢ÃƒÂ¢Ã¢â€šÂ¬Ã…Â¡Ãƒâ€šÃ‚Â¬ÃƒÆ’Ã¢â‚¬Â¦Ãƒâ€šÃ‚Â¡ÃƒÆ’Ã†â€™ÃƒÂ¢Ã¢â€šÂ¬Ã…Â¡ÃƒÆ’Ã¢â‚¬Å¡Ãƒâ€šÃ‚Â¬ÃƒÆ’Ã†â€™Ãƒâ€ Ã¢â‚¬â„¢ÃƒÆ’Ã‚Â¢ÃƒÂ¢Ã¢â‚¬Å¡Ã‚Â¬Ãƒâ€šÃ‚Â¦ÃƒÆ’Ã†â€™ÃƒÂ¢Ã¢â€šÂ¬Ã…Â¡ÃƒÆ’Ã¢â‚¬Å¡Ãƒâ€šÃ‚Â¡ÃƒÆ’Ã†â€™Ãƒâ€ Ã¢â‚¬â„¢ÃƒÆ’Ã¢â‚¬Â ÃƒÂ¢Ã¢â€šÂ¬Ã¢â€žÂ¢ÃƒÆ’Ã†â€™Ãƒâ€šÃ‚Â¢ÃƒÆ’Ã‚Â¢ÃƒÂ¢Ã¢â€šÂ¬Ã…Â¡Ãƒâ€šÃ‚Â¬ÃƒÆ’Ã¢â‚¬Â¦Ãƒâ€šÃ‚Â¡ÃƒÆ’Ã†â€™Ãƒâ€ Ã¢â‚¬â„¢ÃƒÆ’Ã‚Â¢ÃƒÂ¢Ã¢â‚¬Å¡Ã‚Â¬Ãƒâ€¦Ã‚Â¡ÃƒÆ’Ã†â€™ÃƒÂ¢Ã¢â€šÂ¬Ã…Â¡ÃƒÆ’Ã¢â‚¬Å¡Ãƒâ€šÃ‚Â¬ÃƒÆ’Ã†â€™Ãƒâ€ Ã¢â‚¬â„¢ÃƒÆ’Ã¢â‚¬Â ÃƒÂ¢Ã¢â€šÂ¬Ã¢â€žÂ¢ÃƒÆ’Ã†â€™ÃƒÂ¢Ã¢â€šÂ¬Ã‚Â ÃƒÆ’Ã‚Â¢ÃƒÂ¢Ã¢â‚¬Å¡Ã‚Â¬ÃƒÂ¢Ã¢â‚¬Å¾Ã‚Â¢ÃƒÆ’Ã†â€™Ãƒâ€ Ã¢â‚¬â„¢ÃƒÆ’Ã¢â‚¬Å¡Ãƒâ€šÃ‚Â¢ÃƒÆ’Ã†â€™Ãƒâ€šÃ‚Â¢ÃƒÆ’Ã‚Â¢ÃƒÂ¢Ã¢â‚¬Å¡Ã‚Â¬Ãƒâ€¦Ã‚Â¡ÃƒÆ’Ã¢â‚¬Å¡Ãƒâ€šÃ‚Â¬ÃƒÆ’Ã†â€™ÃƒÂ¢Ã¢â€šÂ¬Ã…Â¡ÃƒÆ’Ã¢â‚¬Å¡Ãƒâ€šÃ‚Â¦ÃƒÆ’Ã†â€™Ãƒâ€ Ã¢â‚¬â„¢ÃƒÆ’Ã¢â‚¬Â ÃƒÂ¢Ã¢â€šÂ¬Ã¢â€žÂ¢ÃƒÆ’Ã†â€™ÃƒÂ¢Ã¢â€šÂ¬Ã…Â¡ÃƒÆ’Ã¢â‚¬Å¡Ãƒâ€šÃ‚Â¢ÃƒÆ’Ã†â€™Ãƒâ€ Ã¢â‚¬â„¢ÃƒÆ’Ã¢â‚¬Å¡Ãƒâ€šÃ‚Â¢ÃƒÆ’Ã†â€™Ãƒâ€šÃ‚Â¢ÃƒÆ’Ã‚Â¢ÃƒÂ¢Ã¢â€šÂ¬Ã…Â¡Ãƒâ€šÃ‚Â¬ÃƒÆ’Ã¢â‚¬Â¦Ãƒâ€šÃ‚Â¡ÃƒÆ’Ã†â€™ÃƒÂ¢Ã¢â€šÂ¬Ã…Â¡ÃƒÆ’Ã¢â‚¬Å¡Ãƒâ€šÃ‚Â¬ÃƒÆ’Ã†â€™Ãƒâ€ Ã¢â‚¬â„¢ÃƒÆ’Ã‚Â¢ÃƒÂ¢Ã¢â‚¬Å¡Ã‚Â¬Ãƒâ€šÃ‚Â¦ÃƒÆ’Ã†â€™Ãƒâ€šÃ‚Â¢ÃƒÆ’Ã‚Â¢ÃƒÂ¢Ã¢â€šÂ¬Ã…Â¡Ãƒâ€šÃ‚Â¬ÃƒÆ’Ã¢â‚¬Â¦ÃƒÂ¢Ã¢â€šÂ¬Ã…â€œWk6), both systems recovered, with Monoculture reaching a higher peak growth rate (4.872%/day) compared to IMTA (2.246%/day). Overall, although Monoculture showed higher peak SGR values, the IMTA system demonstrated more stable and consistent </w:t>
       </w:r>
       <w:r>
         <w:rPr>
@@ -5421,7 +5421,7 @@
         <w:rPr>
           <w:rFonts w:ascii="Times New Roman" w:hAnsi="Times New Roman" w:cs="Times New Roman"/>
         </w:rPr>
-        <w:t xml:space="preserve"> across three experimental replicates. Overall, the statistical analysis shows no significant difference in weight gain between the replicates, as indicated by the One-Way ANOVA result (p = 0.5416), which is well above the 0.05 significance level. This is further supported by the ÃƒÆ’Ã†â€™Ãƒâ€ Ã¢â‚¬â„¢ÃƒÆ’Ã¢â‚¬Â ÃƒÂ¢Ã¢â€šÂ¬Ã¢â€žÂ¢ÃƒÆ’Ã†â€™ÃƒÂ¢Ã¢â€šÂ¬Ã‚Â ÃƒÆ’Ã‚Â¢ÃƒÂ¢Ã¢â‚¬Å¡Ã‚Â¬ÃƒÂ¢Ã¢â‚¬Å¾Ã‚Â¢ÃƒÆ’Ã†â€™Ãƒâ€ Ã¢â‚¬â„¢ÃƒÆ’Ã‚Â¢ÃƒÂ¢Ã¢â‚¬Å¡Ã‚Â¬Ãƒâ€¦Ã‚Â¡ÃƒÆ’Ã†â€™ÃƒÂ¢Ã¢â€šÂ¬Ã…Â¡ÃƒÆ’Ã¢â‚¬Å¡Ãƒâ€šÃ‚Â¢ÃƒÆ’Ã†â€™Ãƒâ€ Ã¢â‚¬â„¢ÃƒÆ’Ã¢â‚¬Â ÃƒÂ¢Ã¢â€šÂ¬Ã¢â€žÂ¢ÃƒÆ’Ã†â€™ÃƒÂ¢Ã¢â€šÂ¬Ã…Â¡ÃƒÆ’Ã¢â‚¬Å¡Ãƒâ€šÃ‚Â¢ÃƒÆ’Ã†â€™Ãƒâ€ Ã¢â‚¬â„¢ÃƒÆ’Ã¢â‚¬Å¡Ãƒâ€šÃ‚Â¢ÃƒÆ’Ã†â€™Ãƒâ€šÃ‚Â¢ÃƒÆ’Ã‚Â¢ÃƒÂ¢Ã¢â‚¬Å¡Ã‚Â¬Ãƒâ€¦Ã‚Â¡ÃƒÆ’Ã¢â‚¬Å¡Ãƒâ€šÃ‚Â¬ÃƒÆ’Ã†â€™ÃƒÂ¢Ã¢â€šÂ¬Ã‚Â¦ÃƒÆ’Ã¢â‚¬Å¡Ãƒâ€šÃ‚Â¡ÃƒÆ’Ã†â€™Ãƒâ€ Ã¢â‚¬â„¢ÃƒÆ’Ã‚Â¢ÃƒÂ¢Ã¢â‚¬Å¡Ã‚Â¬Ãƒâ€¦Ã‚Â¡ÃƒÆ’Ã†â€™ÃƒÂ¢Ã¢â€šÂ¬Ã…Â¡ÃƒÆ’Ã¢â‚¬Å¡Ãƒâ€šÃ‚Â¬ÃƒÆ’Ã†â€™Ãƒâ€ Ã¢â‚¬â„¢ÃƒÆ’Ã¢â‚¬Â ÃƒÂ¢Ã¢â€šÂ¬Ã¢â€žÂ¢ÃƒÆ’Ã†â€™Ãƒâ€šÃ‚Â¢ÃƒÆ’Ã‚Â¢ÃƒÂ¢Ã¢â€šÂ¬Ã…Â¡Ãƒâ€šÃ‚Â¬ÃƒÆ’Ã¢â‚¬Å¡Ãƒâ€šÃ‚Â¦ÃƒÆ’Ã†â€™Ãƒâ€ Ã¢â‚¬â„¢ÃƒÆ’Ã¢â‚¬Å¡Ãƒâ€šÃ‚Â¢ÃƒÆ’Ã†â€™Ãƒâ€šÃ‚Â¢ÃƒÆ’Ã‚Â¢ÃƒÂ¢Ã¢â‚¬Å¡Ã‚Â¬Ãƒâ€¦Ã‚Â¡ÃƒÆ’Ã¢â‚¬Å¡Ãƒâ€šÃ‚Â¬ÃƒÆ’Ã†â€™ÃƒÂ¢Ã¢â€šÂ¬Ã‚Â¦ÃƒÆ’Ã‚Â¢ÃƒÂ¢Ã¢â‚¬Å¡Ã‚Â¬Ãƒâ€¦Ã¢â‚¬Å“nsÃƒÆ’Ã†â€™Ãƒâ€ Ã¢â‚¬â„¢ÃƒÆ’Ã¢â‚¬Â ÃƒÂ¢Ã¢â€šÂ¬Ã¢â€žÂ¢ÃƒÆ’Ã†â€™ÃƒÂ¢Ã¢â€šÂ¬Ã‚Â ÃƒÆ’Ã‚Â¢ÃƒÂ¢Ã¢â‚¬Å¡Ã‚Â¬ÃƒÂ¢Ã¢â‚¬Å¾Ã‚Â¢ÃƒÆ’Ã†â€™Ãƒâ€ Ã¢â‚¬â„¢ÃƒÆ’Ã‚Â¢ÃƒÂ¢Ã¢â‚¬Å¡Ã‚Â¬Ãƒâ€¦Ã‚Â¡ÃƒÆ’Ã†â€™ÃƒÂ¢Ã¢â€šÂ¬Ã…Â¡ÃƒÆ’Ã¢â‚¬Å¡Ãƒâ€šÃ‚Â¢ÃƒÆ’Ã†â€™Ãƒâ€ Ã¢â‚¬â„¢ÃƒÆ’Ã¢â‚¬Â ÃƒÂ¢Ã¢â€šÂ¬Ã¢â€žÂ¢ÃƒÆ’Ã†â€™ÃƒÂ¢Ã¢â€šÂ¬Ã…Â¡ÃƒÆ’Ã¢â‚¬Å¡Ãƒâ€šÃ‚Â¢ÃƒÆ’Ã†â€™Ãƒâ€ Ã¢â‚¬â„¢ÃƒÆ’Ã¢â‚¬Å¡Ãƒâ€šÃ‚Â¢ÃƒÆ’Ã†â€™Ãƒâ€šÃ‚Â¢ÃƒÆ’Ã‚Â¢ÃƒÂ¢Ã¢â‚¬Å¡Ã‚Â¬Ãƒâ€¦Ã‚Â¡ÃƒÆ’Ã¢â‚¬Å¡Ãƒâ€šÃ‚Â¬ÃƒÆ’Ã†â€™ÃƒÂ¢Ã¢â€šÂ¬Ã‚Â¦ÃƒÆ’Ã¢â‚¬Å¡Ãƒâ€šÃ‚Â¡ÃƒÆ’Ã†â€™Ãƒâ€ Ã¢â‚¬â„¢ÃƒÆ’Ã‚Â¢ÃƒÂ¢Ã¢â‚¬Å¡Ã‚Â¬Ãƒâ€¦Ã‚Â¡ÃƒÆ’Ã†â€™ÃƒÂ¢Ã¢â€šÂ¬Ã…Â¡ÃƒÆ’Ã¢â‚¬Å¡Ãƒâ€šÃ‚Â¬ÃƒÆ’Ã†â€™Ãƒâ€ Ã¢â‚¬â„¢ÃƒÆ’Ã¢â‚¬Â ÃƒÂ¢Ã¢â€šÂ¬Ã¢â€žÂ¢ÃƒÆ’Ã†â€™Ãƒâ€šÃ‚Â¢ÃƒÆ’Ã‚Â¢ÃƒÂ¢Ã¢â€šÂ¬Ã…Â¡Ãƒâ€šÃ‚Â¬ÃƒÆ’Ã¢â‚¬Â¦Ãƒâ€šÃ‚Â¡ÃƒÆ’Ã†â€™Ãƒâ€ Ã¢â‚¬â„¢ÃƒÆ’Ã‚Â¢ÃƒÂ¢Ã¢â‚¬Å¡Ã‚Â¬Ãƒâ€¦Ã‚Â¡ÃƒÆ’Ã†â€™ÃƒÂ¢Ã¢â€šÂ¬Ã…Â¡ÃƒÆ’Ã¢â‚¬Å¡Ãƒâ€šÃ‚Â (non-significant) labels in the pairwise comparisons, confirming that none of the replicates differed meaningfully from each other.</w:t>
+        <w:t xml:space="preserve"> across three experimental replicates. Overall, the statistical analysis shows no significant difference in weight gain between the replicates, as indicated by the One-Way ANOVA result (p = 0.5416), which is well above the 0.05 significance level. This is further supported by the ÃƒÆ’Ã†â€™Ãƒâ€ Ã¢â‚¬â„¢ÃƒÆ’Ã¢â‚¬Â ÃƒÂ¢Ã¢â€šÂ¬Ã¢â€žÂ¢ÃƒÆ’Ã†â€™ÃƒÂ¢Ã¢â€šÂ¬Ã‚Â ÃƒÆ’Ã‚Â¢ÃƒÂ¢Ã¢â‚¬Å¡Ã‚Â¬ÃƒÂ¢Ã¢â‚¬Å¾Ã‚Â¢ÃƒÆ’Ã†â€™Ãƒâ€ Ã¢â‚¬â„¢ÃƒÆ’Ã‚Â¢ÃƒÂ¢Ã¢â‚¬Å¡Ã‚Â¬Ãƒâ€šÃ‚Â ÃƒÆ’Ã†â€™Ãƒâ€šÃ‚Â¢ÃƒÆ’Ã‚Â¢ÃƒÂ¢Ã¢â€šÂ¬Ã…Â¡Ãƒâ€šÃ‚Â¬ÃƒÆ’Ã‚Â¢ÃƒÂ¢Ã¢â€šÂ¬Ã…Â¾Ãƒâ€šÃ‚Â¢ÃƒÆ’Ã†â€™Ãƒâ€ Ã¢â‚¬â„¢ÃƒÆ’Ã¢â‚¬Â ÃƒÂ¢Ã¢â€šÂ¬Ã¢â€žÂ¢ÃƒÆ’Ã†â€™Ãƒâ€šÃ‚Â¢ÃƒÆ’Ã‚Â¢ÃƒÂ¢Ã¢â€šÂ¬Ã…Â¡Ãƒâ€šÃ‚Â¬ÃƒÆ’Ã¢â‚¬Å¡Ãƒâ€šÃ‚Â ÃƒÆ’Ã†â€™Ãƒâ€ Ã¢â‚¬â„¢ÃƒÆ’Ã¢â‚¬Å¡Ãƒâ€šÃ‚Â¢ÃƒÆ’Ã†â€™Ãƒâ€šÃ‚Â¢ÃƒÆ’Ã‚Â¢ÃƒÂ¢Ã¢â‚¬Å¡Ã‚Â¬Ãƒâ€¦Ã‚Â¡ÃƒÆ’Ã¢â‚¬Å¡Ãƒâ€šÃ‚Â¬ÃƒÆ’Ã†â€™Ãƒâ€šÃ‚Â¢ÃƒÆ’Ã‚Â¢ÃƒÂ¢Ã¢â‚¬Å¡Ã‚Â¬Ãƒâ€¦Ã‚Â¾ÃƒÆ’Ã¢â‚¬Å¡Ãƒâ€šÃ‚Â¢ÃƒÆ’Ã†â€™Ãƒâ€ Ã¢â‚¬â„¢ÃƒÆ’Ã¢â‚¬Â ÃƒÂ¢Ã¢â€šÂ¬Ã¢â€žÂ¢ÃƒÆ’Ã†â€™ÃƒÂ¢Ã¢â€šÂ¬Ã‚Â ÃƒÆ’Ã‚Â¢ÃƒÂ¢Ã¢â‚¬Å¡Ã‚Â¬ÃƒÂ¢Ã¢â‚¬Å¾Ã‚Â¢ÃƒÆ’Ã†â€™Ãƒâ€ Ã¢â‚¬â„¢ÃƒÆ’Ã¢â‚¬Å¡Ãƒâ€šÃ‚Â¢ÃƒÆ’Ã†â€™Ãƒâ€šÃ‚Â¢ÃƒÆ’Ã‚Â¢ÃƒÂ¢Ã¢â‚¬Å¡Ã‚Â¬Ãƒâ€¦Ã‚Â¡ÃƒÆ’Ã¢â‚¬Å¡Ãƒâ€šÃ‚Â¬ÃƒÆ’Ã†â€™ÃƒÂ¢Ã¢â€šÂ¬Ã‚Â¦ÃƒÆ’Ã¢â‚¬Å¡Ãƒâ€šÃ‚Â¡ÃƒÆ’Ã†â€™Ãƒâ€ Ã¢â‚¬â„¢ÃƒÆ’Ã¢â‚¬Â ÃƒÂ¢Ã¢â€šÂ¬Ã¢â€žÂ¢ÃƒÆ’Ã†â€™Ãƒâ€šÃ‚Â¢ÃƒÆ’Ã‚Â¢ÃƒÂ¢Ã¢â€šÂ¬Ã…Â¡Ãƒâ€šÃ‚Â¬ÃƒÆ’Ã¢â‚¬Â¦Ãƒâ€šÃ‚Â¡ÃƒÆ’Ã†â€™Ãƒâ€ Ã¢â‚¬â„¢ÃƒÆ’Ã‚Â¢ÃƒÂ¢Ã¢â‚¬Å¡Ã‚Â¬Ãƒâ€¦Ã‚Â¡ÃƒÆ’Ã†â€™ÃƒÂ¢Ã¢â€šÂ¬Ã…Â¡ÃƒÆ’Ã¢â‚¬Å¡Ãƒâ€šÃ‚Â¢ÃƒÆ’Ã†â€™Ãƒâ€ Ã¢â‚¬â„¢ÃƒÆ’Ã¢â‚¬Â ÃƒÂ¢Ã¢â€šÂ¬Ã¢â€žÂ¢ÃƒÆ’Ã†â€™ÃƒÂ¢Ã¢â€šÂ¬Ã‚Â ÃƒÆ’Ã‚Â¢ÃƒÂ¢Ã¢â‚¬Å¡Ã‚Â¬ÃƒÂ¢Ã¢â‚¬Å¾Ã‚Â¢ÃƒÆ’Ã†â€™Ãƒâ€ Ã¢â‚¬â„¢ÃƒÆ’Ã‚Â¢ÃƒÂ¢Ã¢â‚¬Å¡Ã‚Â¬Ãƒâ€šÃ‚Â ÃƒÆ’Ã†â€™Ãƒâ€šÃ‚Â¢ÃƒÆ’Ã‚Â¢ÃƒÂ¢Ã¢â€šÂ¬Ã…Â¡Ãƒâ€šÃ‚Â¬ÃƒÆ’Ã‚Â¢ÃƒÂ¢Ã¢â€šÂ¬Ã…Â¾Ãƒâ€šÃ‚Â¢ÃƒÆ’Ã†â€™Ãƒâ€ Ã¢â‚¬â„¢ÃƒÆ’Ã¢â‚¬Â ÃƒÂ¢Ã¢â€šÂ¬Ã¢â€žÂ¢ÃƒÆ’Ã†â€™Ãƒâ€šÃ‚Â¢ÃƒÆ’Ã‚Â¢ÃƒÂ¢Ã¢â€šÂ¬Ã…Â¡Ãƒâ€šÃ‚Â¬ÃƒÆ’Ã¢â‚¬Â¦Ãƒâ€šÃ‚Â¡ÃƒÆ’Ã†â€™Ãƒâ€ Ã¢â‚¬â„¢ÃƒÆ’Ã‚Â¢ÃƒÂ¢Ã¢â‚¬Å¡Ã‚Â¬Ãƒâ€¦Ã‚Â¡ÃƒÆ’Ã†â€™ÃƒÂ¢Ã¢â€šÂ¬Ã…Â¡ÃƒÆ’Ã¢â‚¬Å¡Ãƒâ€šÃ‚Â¢ÃƒÆ’Ã†â€™Ãƒâ€ Ã¢â‚¬â„¢ÃƒÆ’Ã¢â‚¬Â ÃƒÂ¢Ã¢â€šÂ¬Ã¢â€žÂ¢ÃƒÆ’Ã†â€™ÃƒÂ¢Ã¢â€šÂ¬Ã‚Â ÃƒÆ’Ã‚Â¢ÃƒÂ¢Ã¢â‚¬Å¡Ã‚Â¬ÃƒÂ¢Ã¢â‚¬Å¾Ã‚Â¢ÃƒÆ’Ã†â€™Ãƒâ€ Ã¢â‚¬â„¢ÃƒÆ’Ã‚Â¢ÃƒÂ¢Ã¢â‚¬Å¡Ã‚Â¬Ãƒâ€¦Ã‚Â¡ÃƒÆ’Ã†â€™ÃƒÂ¢Ã¢â€šÂ¬Ã…Â¡ÃƒÆ’Ã¢â‚¬Å¡Ãƒâ€šÃ‚Â¢ÃƒÆ’Ã†â€™Ãƒâ€ Ã¢â‚¬â„¢ÃƒÆ’Ã¢â‚¬Â ÃƒÂ¢Ã¢â€šÂ¬Ã¢â€žÂ¢ÃƒÆ’Ã†â€™ÃƒÂ¢Ã¢â€šÂ¬Ã…Â¡ÃƒÆ’Ã¢â‚¬Å¡Ãƒâ€šÃ‚Â¢ÃƒÆ’Ã†â€™Ãƒâ€ Ã¢â‚¬â„¢ÃƒÆ’Ã¢â‚¬Å¡Ãƒâ€šÃ‚Â¢ÃƒÆ’Ã†â€™Ãƒâ€šÃ‚Â¢ÃƒÆ’Ã‚Â¢ÃƒÂ¢Ã¢â‚¬Å¡Ã‚Â¬Ãƒâ€¦Ã‚Â¡ÃƒÆ’Ã¢â‚¬Å¡Ãƒâ€šÃ‚Â¬ÃƒÆ’Ã†â€™ÃƒÂ¢Ã¢â€šÂ¬Ã‚Â¦ÃƒÆ’Ã¢â‚¬Å¡Ãƒâ€šÃ‚Â¡ÃƒÆ’Ã†â€™Ãƒâ€ Ã¢â‚¬â„¢ÃƒÆ’Ã‚Â¢ÃƒÂ¢Ã¢â‚¬Å¡Ã‚Â¬Ãƒâ€¦Ã‚Â¡ÃƒÆ’Ã†â€™ÃƒÂ¢Ã¢â€šÂ¬Ã…Â¡ÃƒÆ’Ã¢â‚¬Å¡Ãƒâ€šÃ‚Â¬ÃƒÆ’Ã†â€™Ãƒâ€ Ã¢â‚¬â„¢ÃƒÆ’Ã¢â‚¬Â ÃƒÂ¢Ã¢â€šÂ¬Ã¢â€žÂ¢ÃƒÆ’Ã†â€™Ãƒâ€šÃ‚Â¢ÃƒÆ’Ã‚Â¢ÃƒÂ¢Ã¢â€šÂ¬Ã…Â¡Ãƒâ€šÃ‚Â¬ÃƒÆ’Ã¢â‚¬Å¡Ãƒâ€šÃ‚Â¦ÃƒÆ’Ã†â€™Ãƒâ€ Ã¢â‚¬â„¢ÃƒÆ’Ã‚Â¢ÃƒÂ¢Ã¢â‚¬Å¡Ã‚Â¬Ãƒâ€¦Ã‚Â¡ÃƒÆ’Ã†â€™ÃƒÂ¢Ã¢â€šÂ¬Ã…Â¡ÃƒÆ’Ã¢â‚¬Å¡Ãƒâ€šÃ‚Â¡ÃƒÆ’Ã†â€™Ãƒâ€ Ã¢â‚¬â„¢ÃƒÆ’Ã¢â‚¬Â ÃƒÂ¢Ã¢â€šÂ¬Ã¢â€žÂ¢ÃƒÆ’Ã†â€™ÃƒÂ¢Ã¢â€šÂ¬Ã‚Â ÃƒÆ’Ã‚Â¢ÃƒÂ¢Ã¢â‚¬Å¡Ã‚Â¬ÃƒÂ¢Ã¢â‚¬Å¾Ã‚Â¢ÃƒÆ’Ã†â€™Ãƒâ€ Ã¢â‚¬â„¢ÃƒÆ’Ã¢â‚¬Å¡Ãƒâ€šÃ‚Â¢ÃƒÆ’Ã†â€™Ãƒâ€šÃ‚Â¢ÃƒÆ’Ã‚Â¢ÃƒÂ¢Ã¢â‚¬Å¡Ã‚Â¬Ãƒâ€¦Ã‚Â¡ÃƒÆ’Ã¢â‚¬Å¡Ãƒâ€šÃ‚Â¬ÃƒÆ’Ã†â€™ÃƒÂ¢Ã¢â€šÂ¬Ã‚Â¦ÃƒÆ’Ã¢â‚¬Å¡Ãƒâ€šÃ‚Â¡ÃƒÆ’Ã†â€™Ãƒâ€ Ã¢â‚¬â„¢ÃƒÆ’Ã¢â‚¬Â ÃƒÂ¢Ã¢â€šÂ¬Ã¢â€žÂ¢ÃƒÆ’Ã†â€™Ãƒâ€šÃ‚Â¢ÃƒÆ’Ã‚Â¢ÃƒÂ¢Ã¢â€šÂ¬Ã…Â¡Ãƒâ€šÃ‚Â¬ÃƒÆ’Ã¢â‚¬Â¦Ãƒâ€šÃ‚Â¡ÃƒÆ’Ã†â€™Ãƒâ€ Ã¢â‚¬â„¢ÃƒÆ’Ã‚Â¢ÃƒÂ¢Ã¢â‚¬Å¡Ã‚Â¬Ãƒâ€¦Ã‚Â¡ÃƒÆ’Ã†â€™ÃƒÂ¢Ã¢â€šÂ¬Ã…Â¡ÃƒÆ’Ã¢â‚¬Å¡Ãƒâ€šÃ‚Â¬ÃƒÆ’Ã†â€™Ãƒâ€ Ã¢â‚¬â„¢ÃƒÆ’Ã¢â‚¬Â ÃƒÂ¢Ã¢â€šÂ¬Ã¢â€žÂ¢ÃƒÆ’Ã†â€™ÃƒÂ¢Ã¢â€šÂ¬Ã‚Â ÃƒÆ’Ã‚Â¢ÃƒÂ¢Ã¢â‚¬Å¡Ã‚Â¬ÃƒÂ¢Ã¢â‚¬Å¾Ã‚Â¢ÃƒÆ’Ã†â€™Ãƒâ€ Ã¢â‚¬â„¢ÃƒÆ’Ã‚Â¢ÃƒÂ¢Ã¢â‚¬Å¡Ã‚Â¬Ãƒâ€šÃ‚Â ÃƒÆ’Ã†â€™Ãƒâ€šÃ‚Â¢ÃƒÆ’Ã‚Â¢ÃƒÂ¢Ã¢â€šÂ¬Ã…Â¡Ãƒâ€šÃ‚Â¬ÃƒÆ’Ã‚Â¢ÃƒÂ¢Ã¢â€šÂ¬Ã…Â¾Ãƒâ€šÃ‚Â¢ÃƒÆ’Ã†â€™Ãƒâ€ Ã¢â‚¬â„¢ÃƒÆ’Ã¢â‚¬Â ÃƒÂ¢Ã¢â€šÂ¬Ã¢â€žÂ¢ÃƒÆ’Ã†â€™ÃƒÂ¢Ã¢â€šÂ¬Ã…Â¡ÃƒÆ’Ã¢â‚¬Å¡Ãƒâ€šÃ‚Â¢ÃƒÆ’Ã†â€™Ãƒâ€ Ã¢â‚¬â„¢ÃƒÆ’Ã¢â‚¬Å¡Ãƒâ€šÃ‚Â¢ÃƒÆ’Ã†â€™Ãƒâ€šÃ‚Â¢ÃƒÆ’Ã‚Â¢ÃƒÂ¢Ã¢â€šÂ¬Ã…Â¡Ãƒâ€šÃ‚Â¬ÃƒÆ’Ã¢â‚¬Â¦Ãƒâ€šÃ‚Â¡ÃƒÆ’Ã†â€™ÃƒÂ¢Ã¢â€šÂ¬Ã…Â¡ÃƒÆ’Ã¢â‚¬Å¡Ãƒâ€šÃ‚Â¬ÃƒÆ’Ã†â€™Ãƒâ€ Ã¢â‚¬â„¢ÃƒÆ’Ã‚Â¢ÃƒÂ¢Ã¢â‚¬Å¡Ã‚Â¬Ãƒâ€¦Ã‚Â¡ÃƒÆ’Ã†â€™ÃƒÂ¢Ã¢â€šÂ¬Ã…Â¡ÃƒÆ’Ã¢â‚¬Å¡Ãƒâ€šÃ‚Â¦ÃƒÆ’Ã†â€™Ãƒâ€ Ã¢â‚¬â„¢ÃƒÆ’Ã¢â‚¬Â ÃƒÂ¢Ã¢â€šÂ¬Ã¢â€žÂ¢ÃƒÆ’Ã†â€™ÃƒÂ¢Ã¢â€šÂ¬Ã‚Â ÃƒÆ’Ã‚Â¢ÃƒÂ¢Ã¢â‚¬Å¡Ã‚Â¬ÃƒÂ¢Ã¢â‚¬Å¾Ã‚Â¢ÃƒÆ’Ã†â€™Ãƒâ€ Ã¢â‚¬â„¢ÃƒÆ’Ã‚Â¢ÃƒÂ¢Ã¢â‚¬Å¡Ã‚Â¬Ãƒâ€¦Ã‚Â¡ÃƒÆ’Ã†â€™ÃƒÂ¢Ã¢â€šÂ¬Ã…Â¡ÃƒÆ’Ã¢â‚¬Å¡Ãƒâ€šÃ‚Â¢ÃƒÆ’Ã†â€™Ãƒâ€ Ã¢â‚¬â„¢ÃƒÆ’Ã¢â‚¬Â ÃƒÂ¢Ã¢â€šÂ¬Ã¢â€žÂ¢ÃƒÆ’Ã†â€™ÃƒÂ¢Ã¢â€šÂ¬Ã…Â¡ÃƒÆ’Ã¢â‚¬Å¡Ãƒâ€šÃ‚Â¢ÃƒÆ’Ã†â€™Ãƒâ€ Ã¢â‚¬â„¢ÃƒÆ’Ã¢â‚¬Å¡Ãƒâ€šÃ‚Â¢ÃƒÆ’Ã†â€™Ãƒâ€šÃ‚Â¢ÃƒÆ’Ã‚Â¢ÃƒÂ¢Ã¢â‚¬Å¡Ã‚Â¬Ãƒâ€¦Ã‚Â¡ÃƒÆ’Ã¢â‚¬Å¡Ãƒâ€šÃ‚Â¬ÃƒÆ’Ã†â€™ÃƒÂ¢Ã¢â€šÂ¬Ã‚Â¦ÃƒÆ’Ã¢â‚¬Å¡Ãƒâ€šÃ‚Â¡ÃƒÆ’Ã†â€™Ãƒâ€ Ã¢â‚¬â„¢ÃƒÆ’Ã‚Â¢ÃƒÂ¢Ã¢â‚¬Å¡Ã‚Â¬Ãƒâ€¦Ã‚Â¡ÃƒÆ’Ã†â€™ÃƒÂ¢Ã¢â€šÂ¬Ã…Â¡ÃƒÆ’Ã¢â‚¬Å¡Ãƒâ€šÃ‚Â¬ÃƒÆ’Ã†â€™Ãƒâ€ Ã¢â‚¬â„¢ÃƒÆ’Ã¢â‚¬Â ÃƒÂ¢Ã¢â€šÂ¬Ã¢â€žÂ¢ÃƒÆ’Ã†â€™Ãƒâ€šÃ‚Â¢ÃƒÆ’Ã‚Â¢ÃƒÂ¢Ã¢â€šÂ¬Ã…Â¡Ãƒâ€šÃ‚Â¬ÃƒÆ’Ã¢â‚¬Å¡Ãƒâ€šÃ‚Â¦ÃƒÆ’Ã†â€™Ãƒâ€ Ã¢â‚¬â„¢ÃƒÆ’Ã¢â‚¬Å¡Ãƒâ€šÃ‚Â¢ÃƒÆ’Ã†â€™Ãƒâ€šÃ‚Â¢ÃƒÆ’Ã‚Â¢ÃƒÂ¢Ã¢â‚¬Å¡Ã‚Â¬Ãƒâ€¦Ã‚Â¡ÃƒÆ’Ã¢â‚¬Å¡Ãƒâ€šÃ‚Â¬ÃƒÆ’Ã†â€™ÃƒÂ¢Ã¢â€šÂ¬Ã‚Â¦ÃƒÆ’Ã‚Â¢ÃƒÂ¢Ã¢â‚¬Å¡Ã‚Â¬Ãƒâ€¦Ã¢â‚¬Å“nsÃƒÆ’Ã†â€™Ãƒâ€ Ã¢â‚¬â„¢ÃƒÆ’Ã¢â‚¬Â ÃƒÂ¢Ã¢â€šÂ¬Ã¢â€žÂ¢ÃƒÆ’Ã†â€™ÃƒÂ¢Ã¢â€šÂ¬Ã‚Â ÃƒÆ’Ã‚Â¢ÃƒÂ¢Ã¢â‚¬Å¡Ã‚Â¬ÃƒÂ¢Ã¢â‚¬Å¾Ã‚Â¢ÃƒÆ’Ã†â€™Ãƒâ€ Ã¢â‚¬â„¢ÃƒÆ’Ã‚Â¢ÃƒÂ¢Ã¢â‚¬Å¡Ã‚Â¬Ãƒâ€šÃ‚Â ÃƒÆ’Ã†â€™Ãƒâ€šÃ‚Â¢ÃƒÆ’Ã‚Â¢ÃƒÂ¢Ã¢â€šÂ¬Ã…Â¡Ãƒâ€šÃ‚Â¬ÃƒÆ’Ã‚Â¢ÃƒÂ¢Ã¢â€šÂ¬Ã…Â¾Ãƒâ€šÃ‚Â¢ÃƒÆ’Ã†â€™Ãƒâ€ Ã¢â‚¬â„¢ÃƒÆ’Ã¢â‚¬Â ÃƒÂ¢Ã¢â€šÂ¬Ã¢â€žÂ¢ÃƒÆ’Ã†â€™Ãƒâ€šÃ‚Â¢ÃƒÆ’Ã‚Â¢ÃƒÂ¢Ã¢â€šÂ¬Ã…Â¡Ãƒâ€šÃ‚Â¬ÃƒÆ’Ã¢â‚¬Å¡Ãƒâ€šÃ‚Â ÃƒÆ’Ã†â€™Ãƒâ€ Ã¢â‚¬â„¢ÃƒÆ’Ã¢â‚¬Å¡Ãƒâ€šÃ‚Â¢ÃƒÆ’Ã†â€™Ãƒâ€šÃ‚Â¢ÃƒÆ’Ã‚Â¢ÃƒÂ¢Ã¢â‚¬Å¡Ã‚Â¬Ãƒâ€¦Ã‚Â¡ÃƒÆ’Ã¢â‚¬Å¡Ãƒâ€šÃ‚Â¬ÃƒÆ’Ã†â€™Ãƒâ€šÃ‚Â¢ÃƒÆ’Ã‚Â¢ÃƒÂ¢Ã¢â‚¬Å¡Ã‚Â¬Ãƒâ€¦Ã‚Â¾ÃƒÆ’Ã¢â‚¬Å¡Ãƒâ€šÃ‚Â¢ÃƒÆ’Ã†â€™Ãƒâ€ Ã¢â‚¬â„¢ÃƒÆ’Ã¢â‚¬Â ÃƒÂ¢Ã¢â€šÂ¬Ã¢â€žÂ¢ÃƒÆ’Ã†â€™ÃƒÂ¢Ã¢â€šÂ¬Ã‚Â ÃƒÆ’Ã‚Â¢ÃƒÂ¢Ã¢â‚¬Å¡Ã‚Â¬ÃƒÂ¢Ã¢â‚¬Å¾Ã‚Â¢ÃƒÆ’Ã†â€™Ãƒâ€ Ã¢â‚¬â„¢ÃƒÆ’Ã¢â‚¬Å¡Ãƒâ€šÃ‚Â¢ÃƒÆ’Ã†â€™Ãƒâ€šÃ‚Â¢ÃƒÆ’Ã‚Â¢ÃƒÂ¢Ã¢â‚¬Å¡Ã‚Â¬Ãƒâ€¦Ã‚Â¡ÃƒÆ’Ã¢â‚¬Å¡Ãƒâ€šÃ‚Â¬ÃƒÆ’Ã†â€™ÃƒÂ¢Ã¢â€šÂ¬Ã‚Â¦ÃƒÆ’Ã¢â‚¬Å¡Ãƒâ€šÃ‚Â¡ÃƒÆ’Ã†â€™Ãƒâ€ Ã¢â‚¬â„¢ÃƒÆ’Ã¢â‚¬Â ÃƒÂ¢Ã¢â€šÂ¬Ã¢â€žÂ¢ÃƒÆ’Ã†â€™Ãƒâ€šÃ‚Â¢ÃƒÆ’Ã‚Â¢ÃƒÂ¢Ã¢â€šÂ¬Ã…Â¡Ãƒâ€šÃ‚Â¬ÃƒÆ’Ã¢â‚¬Â¦Ãƒâ€šÃ‚Â¡ÃƒÆ’Ã†â€™Ãƒâ€ Ã¢â‚¬â„¢ÃƒÆ’Ã‚Â¢ÃƒÂ¢Ã¢â‚¬Å¡Ã‚Â¬Ãƒâ€¦Ã‚Â¡ÃƒÆ’Ã†â€™ÃƒÂ¢Ã¢â€šÂ¬Ã…Â¡ÃƒÆ’Ã¢â‚¬Å¡Ãƒâ€šÃ‚Â¢ÃƒÆ’Ã†â€™Ãƒâ€ Ã¢â‚¬â„¢ÃƒÆ’Ã¢â‚¬Â ÃƒÂ¢Ã¢â€šÂ¬Ã¢â€žÂ¢ÃƒÆ’Ã†â€™ÃƒÂ¢Ã¢â€šÂ¬Ã‚Â ÃƒÆ’Ã‚Â¢ÃƒÂ¢Ã¢â‚¬Å¡Ã‚Â¬ÃƒÂ¢Ã¢â‚¬Å¾Ã‚Â¢ÃƒÆ’Ã†â€™Ãƒâ€ Ã¢â‚¬â„¢ÃƒÆ’Ã‚Â¢ÃƒÂ¢Ã¢â‚¬Å¡Ã‚Â¬Ãƒâ€šÃ‚Â ÃƒÆ’Ã†â€™Ãƒâ€šÃ‚Â¢ÃƒÆ’Ã‚Â¢ÃƒÂ¢Ã¢â€šÂ¬Ã…Â¡Ãƒâ€šÃ‚Â¬ÃƒÆ’Ã‚Â¢ÃƒÂ¢Ã¢â€šÂ¬Ã…Â¾Ãƒâ€šÃ‚Â¢ÃƒÆ’Ã†â€™Ãƒâ€ Ã¢â‚¬â„¢ÃƒÆ’Ã¢â‚¬Â ÃƒÂ¢Ã¢â€šÂ¬Ã¢â€žÂ¢ÃƒÆ’Ã†â€™Ãƒâ€šÃ‚Â¢ÃƒÆ’Ã‚Â¢ÃƒÂ¢Ã¢â€šÂ¬Ã…Â¡Ãƒâ€šÃ‚Â¬ÃƒÆ’Ã¢â‚¬Â¦Ãƒâ€šÃ‚Â¡ÃƒÆ’Ã†â€™Ãƒâ€ Ã¢â‚¬â„¢ÃƒÆ’Ã‚Â¢ÃƒÂ¢Ã¢â‚¬Å¡Ã‚Â¬Ãƒâ€¦Ã‚Â¡ÃƒÆ’Ã†â€™ÃƒÂ¢Ã¢â€šÂ¬Ã…Â¡ÃƒÆ’Ã¢â‚¬Å¡Ãƒâ€šÃ‚Â¢ÃƒÆ’Ã†â€™Ãƒâ€ Ã¢â‚¬â„¢ÃƒÆ’Ã¢â‚¬Â ÃƒÂ¢Ã¢â€šÂ¬Ã¢â€žÂ¢ÃƒÆ’Ã†â€™ÃƒÂ¢Ã¢â€šÂ¬Ã‚Â ÃƒÆ’Ã‚Â¢ÃƒÂ¢Ã¢â‚¬Å¡Ã‚Â¬ÃƒÂ¢Ã¢â‚¬Å¾Ã‚Â¢ÃƒÆ’Ã†â€™Ãƒâ€ Ã¢â‚¬â„¢ÃƒÆ’Ã‚Â¢ÃƒÂ¢Ã¢â‚¬Å¡Ã‚Â¬Ãƒâ€¦Ã‚Â¡ÃƒÆ’Ã†â€™ÃƒÂ¢Ã¢â€šÂ¬Ã…Â¡ÃƒÆ’Ã¢â‚¬Å¡Ãƒâ€šÃ‚Â¢ÃƒÆ’Ã†â€™Ãƒâ€ Ã¢â‚¬â„¢ÃƒÆ’Ã¢â‚¬Â ÃƒÂ¢Ã¢â€šÂ¬Ã¢â€žÂ¢ÃƒÆ’Ã†â€™ÃƒÂ¢Ã¢â€šÂ¬Ã…Â¡ÃƒÆ’Ã¢â‚¬Å¡Ãƒâ€šÃ‚Â¢ÃƒÆ’Ã†â€™Ãƒâ€ Ã¢â‚¬â„¢ÃƒÆ’Ã¢â‚¬Å¡Ãƒâ€šÃ‚Â¢ÃƒÆ’Ã†â€™Ãƒâ€šÃ‚Â¢ÃƒÆ’Ã‚Â¢ÃƒÂ¢Ã¢â‚¬Å¡Ã‚Â¬Ãƒâ€¦Ã‚Â¡ÃƒÆ’Ã¢â‚¬Å¡Ãƒâ€šÃ‚Â¬ÃƒÆ’Ã†â€™ÃƒÂ¢Ã¢â€šÂ¬Ã‚Â¦ÃƒÆ’Ã¢â‚¬Å¡Ãƒâ€šÃ‚Â¡ÃƒÆ’Ã†â€™Ãƒâ€ Ã¢â‚¬â„¢ÃƒÆ’Ã‚Â¢ÃƒÂ¢Ã¢â‚¬Å¡Ã‚Â¬Ãƒâ€¦Ã‚Â¡ÃƒÆ’Ã†â€™ÃƒÂ¢Ã¢â€šÂ¬Ã…Â¡ÃƒÆ’Ã¢â‚¬Å¡Ãƒâ€šÃ‚Â¬ÃƒÆ’Ã†â€™Ãƒâ€ Ã¢â‚¬â„¢ÃƒÆ’Ã¢â‚¬Â ÃƒÂ¢Ã¢â€šÂ¬Ã¢â€žÂ¢ÃƒÆ’Ã†â€™Ãƒâ€šÃ‚Â¢ÃƒÆ’Ã‚Â¢ÃƒÂ¢Ã¢â€šÂ¬Ã…Â¡Ãƒâ€šÃ‚Â¬ÃƒÆ’Ã¢â‚¬Å¡Ãƒâ€šÃ‚Â¦ÃƒÆ’Ã†â€™Ãƒâ€ Ã¢â‚¬â„¢ÃƒÆ’Ã‚Â¢ÃƒÂ¢Ã¢â‚¬Å¡Ã‚Â¬Ãƒâ€¦Ã‚Â¡ÃƒÆ’Ã†â€™ÃƒÂ¢Ã¢â€šÂ¬Ã…Â¡ÃƒÆ’Ã¢â‚¬Å¡Ãƒâ€šÃ‚Â¡ÃƒÆ’Ã†â€™Ãƒâ€ Ã¢â‚¬â„¢ÃƒÆ’Ã¢â‚¬Â ÃƒÂ¢Ã¢â€šÂ¬Ã¢â€žÂ¢ÃƒÆ’Ã†â€™ÃƒÂ¢Ã¢â€šÂ¬Ã‚Â ÃƒÆ’Ã‚Â¢ÃƒÂ¢Ã¢â‚¬Å¡Ã‚Â¬ÃƒÂ¢Ã¢â‚¬Å¾Ã‚Â¢ÃƒÆ’Ã†â€™Ãƒâ€ Ã¢â‚¬â„¢ÃƒÆ’Ã¢â‚¬Å¡Ãƒâ€šÃ‚Â¢ÃƒÆ’Ã†â€™Ãƒâ€šÃ‚Â¢ÃƒÆ’Ã‚Â¢ÃƒÂ¢Ã¢â‚¬Å¡Ã‚Â¬Ãƒâ€¦Ã‚Â¡ÃƒÆ’Ã¢â‚¬Å¡Ãƒâ€šÃ‚Â¬ÃƒÆ’Ã†â€™ÃƒÂ¢Ã¢â€šÂ¬Ã‚Â¦ÃƒÆ’Ã¢â‚¬Å¡Ãƒâ€šÃ‚Â¡ÃƒÆ’Ã†â€™Ãƒâ€ Ã¢â‚¬â„¢ÃƒÆ’Ã¢â‚¬Â ÃƒÂ¢Ã¢â€šÂ¬Ã¢â€žÂ¢ÃƒÆ’Ã†â€™Ãƒâ€šÃ‚Â¢ÃƒÆ’Ã‚Â¢ÃƒÂ¢Ã¢â€šÂ¬Ã…Â¡Ãƒâ€šÃ‚Â¬ÃƒÆ’Ã¢â‚¬Â¦Ãƒâ€šÃ‚Â¡ÃƒÆ’Ã†â€™Ãƒâ€ Ã¢â‚¬â„¢ÃƒÆ’Ã‚Â¢ÃƒÂ¢Ã¢â‚¬Å¡Ã‚Â¬Ãƒâ€¦Ã‚Â¡ÃƒÆ’Ã†â€™ÃƒÂ¢Ã¢â€šÂ¬Ã…Â¡ÃƒÆ’Ã¢â‚¬Å¡Ãƒâ€šÃ‚Â¬ÃƒÆ’Ã†â€™Ãƒâ€ Ã¢â‚¬â„¢ÃƒÆ’Ã¢â‚¬Â ÃƒÂ¢Ã¢â€šÂ¬Ã¢â€žÂ¢ÃƒÆ’Ã†â€™ÃƒÂ¢Ã¢â€šÂ¬Ã‚Â ÃƒÆ’Ã‚Â¢ÃƒÂ¢Ã¢â‚¬Å¡Ã‚Â¬ÃƒÂ¢Ã¢â‚¬Å¾Ã‚Â¢ÃƒÆ’Ã†â€™Ãƒâ€ Ã¢â‚¬â„¢ÃƒÆ’Ã‚Â¢ÃƒÂ¢Ã¢â‚¬Å¡Ã‚Â¬Ãƒâ€šÃ‚Â ÃƒÆ’Ã†â€™Ãƒâ€šÃ‚Â¢ÃƒÆ’Ã‚Â¢ÃƒÂ¢Ã¢â€šÂ¬Ã…Â¡Ãƒâ€šÃ‚Â¬ÃƒÆ’Ã‚Â¢ÃƒÂ¢Ã¢â€šÂ¬Ã…Â¾Ãƒâ€šÃ‚Â¢ÃƒÆ’Ã†â€™Ãƒâ€ Ã¢â‚¬â„¢ÃƒÆ’Ã¢â‚¬Â ÃƒÂ¢Ã¢â€šÂ¬Ã¢â€žÂ¢ÃƒÆ’Ã†â€™ÃƒÂ¢Ã¢â€šÂ¬Ã…Â¡ÃƒÆ’Ã¢â‚¬Å¡Ãƒâ€šÃ‚Â¢ÃƒÆ’Ã†â€™Ãƒâ€ Ã¢â‚¬â„¢ÃƒÆ’Ã¢â‚¬Å¡Ãƒâ€šÃ‚Â¢ÃƒÆ’Ã†â€™Ãƒâ€šÃ‚Â¢ÃƒÆ’Ã‚Â¢ÃƒÂ¢Ã¢â€šÂ¬Ã…Â¡Ãƒâ€šÃ‚Â¬ÃƒÆ’Ã¢â‚¬Â¦Ãƒâ€šÃ‚Â¡ÃƒÆ’Ã†â€™ÃƒÂ¢Ã¢â€šÂ¬Ã…Â¡ÃƒÆ’Ã¢â‚¬Å¡Ãƒâ€šÃ‚Â¬ÃƒÆ’Ã†â€™Ãƒâ€ Ã¢â‚¬â„¢ÃƒÆ’Ã‚Â¢ÃƒÂ¢Ã¢â‚¬Å¡Ã‚Â¬Ãƒâ€šÃ‚Â¦ÃƒÆ’Ã†â€™ÃƒÂ¢Ã¢â€šÂ¬Ã…Â¡ÃƒÆ’Ã¢â‚¬Å¡Ãƒâ€šÃ‚Â¡ÃƒÆ’Ã†â€™Ãƒâ€ Ã¢â‚¬â„¢ÃƒÆ’Ã¢â‚¬Â ÃƒÂ¢Ã¢â€šÂ¬Ã¢â€žÂ¢ÃƒÆ’Ã†â€™ÃƒÂ¢Ã¢â€šÂ¬Ã‚Â ÃƒÆ’Ã‚Â¢ÃƒÂ¢Ã¢â‚¬Å¡Ã‚Â¬ÃƒÂ¢Ã¢â‚¬Å¾Ã‚Â¢ÃƒÆ’Ã†â€™Ãƒâ€ Ã¢â‚¬â„¢ÃƒÆ’Ã¢â‚¬Å¡Ãƒâ€šÃ‚Â¢ÃƒÆ’Ã†â€™Ãƒâ€šÃ‚Â¢ÃƒÆ’Ã‚Â¢ÃƒÂ¢Ã¢â‚¬Å¡Ã‚Â¬Ãƒâ€¦Ã‚Â¡ÃƒÆ’Ã¢â‚¬Å¡Ãƒâ€šÃ‚Â¬ÃƒÆ’Ã†â€™ÃƒÂ¢Ã¢â€šÂ¬Ã‚Â¦ÃƒÆ’Ã¢â‚¬Å¡Ãƒâ€šÃ‚Â¡ÃƒÆ’Ã†â€™Ãƒâ€ Ã¢â‚¬â„¢ÃƒÆ’Ã¢â‚¬Â ÃƒÂ¢Ã¢â€šÂ¬Ã¢â€žÂ¢ÃƒÆ’Ã†â€™Ãƒâ€šÃ‚Â¢ÃƒÆ’Ã‚Â¢ÃƒÂ¢Ã¢â€šÂ¬Ã…Â¡Ãƒâ€šÃ‚Â¬ÃƒÆ’Ã¢â‚¬Â¦Ãƒâ€šÃ‚Â¡ÃƒÆ’Ã†â€™Ãƒâ€ Ã¢â‚¬â„¢ÃƒÆ’Ã‚Â¢ÃƒÂ¢Ã¢â‚¬Å¡Ã‚Â¬Ãƒâ€¦Ã‚Â¡ÃƒÆ’Ã†â€™ÃƒÂ¢Ã¢â€šÂ¬Ã…Â¡ÃƒÆ’Ã¢â‚¬Å¡Ãƒâ€šÃ‚Â (non-significant) labels in the pairwise comparisons, confirming that none of the replicates differed meaningfully from each other.</w:t>
       </w:r>
     </w:p>
     <w:p>
@@ -6279,7 +6279,7 @@
         <w:rPr>
           <w:rFonts w:ascii="Times New Roman" w:hAnsi="Times New Roman" w:cs="Times New Roman"/>
         </w:rPr>
-        <w:t>The line graph illustrates the weekly changes in Total Dissolved Solids (TDS), measured in parts per thousand (ppt), for Integrated Multi-Trophic Aquaculture (IMTA) and Monoculture treatments over a seven-week period. At the beginning of the study (Week 1), both treatments recorded identical TDS levels of approximately 16.5 ppt. During the early phase (Weeks 2ÃƒÆ’Ã†â€™Ãƒâ€ Ã¢â‚¬â„¢ÃƒÆ’Ã¢â‚¬Â ÃƒÂ¢Ã¢â€šÂ¬Ã¢â€žÂ¢ÃƒÆ’Ã†â€™ÃƒÂ¢Ã¢â€šÂ¬Ã‚Â ÃƒÆ’Ã‚Â¢ÃƒÂ¢Ã¢â‚¬Å¡Ã‚Â¬ÃƒÂ¢Ã¢â‚¬Å¾Ã‚Â¢ÃƒÆ’Ã†â€™Ãƒâ€ Ã¢â‚¬â„¢ÃƒÆ’Ã‚Â¢ÃƒÂ¢Ã¢â‚¬Å¡Ã‚Â¬Ãƒâ€¦Ã‚Â¡ÃƒÆ’Ã†â€™ÃƒÂ¢Ã¢â€šÂ¬Ã…Â¡ÃƒÆ’Ã¢â‚¬Å¡Ãƒâ€šÃ‚Â¢ÃƒÆ’Ã†â€™Ãƒâ€ Ã¢â‚¬â„¢ÃƒÆ’Ã¢â‚¬Â ÃƒÂ¢Ã¢â€šÂ¬Ã¢â€žÂ¢ÃƒÆ’Ã†â€™ÃƒÂ¢Ã¢â€šÂ¬Ã…Â¡ÃƒÆ’Ã¢â‚¬Å¡Ãƒâ€šÃ‚Â¢ÃƒÆ’Ã†â€™Ãƒâ€ Ã¢â‚¬â„¢ÃƒÆ’Ã¢â‚¬Å¡Ãƒâ€šÃ‚Â¢ÃƒÆ’Ã†â€™Ãƒâ€šÃ‚Â¢ÃƒÆ’Ã‚Â¢ÃƒÂ¢Ã¢â‚¬Å¡Ã‚Â¬Ãƒâ€¦Ã‚Â¡ÃƒÆ’Ã¢â‚¬Å¡Ãƒâ€šÃ‚Â¬ÃƒÆ’Ã†â€™ÃƒÂ¢Ã¢â€šÂ¬Ã‚Â¦ÃƒÆ’Ã¢â‚¬Å¡Ãƒâ€šÃ‚Â¡ÃƒÆ’Ã†â€™Ãƒâ€ Ã¢â‚¬â„¢ÃƒÆ’Ã‚Â¢ÃƒÂ¢Ã¢â‚¬Å¡Ã‚Â¬Ãƒâ€¦Ã‚Â¡ÃƒÆ’Ã†â€™ÃƒÂ¢Ã¢â€šÂ¬Ã…Â¡ÃƒÆ’Ã¢â‚¬Å¡Ãƒâ€šÃ‚Â¬ÃƒÆ’Ã†â€™Ãƒâ€ Ã¢â‚¬â„¢ÃƒÆ’Ã¢â‚¬Â ÃƒÂ¢Ã¢â€šÂ¬Ã¢â€žÂ¢ÃƒÆ’Ã†â€™ÃƒÂ¢Ã¢â€šÂ¬Ã…Â¡ÃƒÆ’Ã¢â‚¬Å¡Ãƒâ€šÃ‚Â¢ÃƒÆ’Ã†â€™Ãƒâ€ Ã¢â‚¬â„¢ÃƒÆ’Ã¢â‚¬Å¡Ãƒâ€šÃ‚Â¢ÃƒÆ’Ã†â€™Ãƒâ€šÃ‚Â¢ÃƒÆ’Ã‚Â¢ÃƒÂ¢Ã¢â€šÂ¬Ã…Â¡Ãƒâ€šÃ‚Â¬ÃƒÆ’Ã¢â‚¬Â¦Ãƒâ€šÃ‚Â¡ÃƒÆ’Ã†â€™ÃƒÂ¢Ã¢â€šÂ¬Ã…Â¡ÃƒÆ’Ã¢â‚¬Å¡Ãƒâ€šÃ‚Â¬ÃƒÆ’Ã†â€™Ãƒâ€ Ã¢â‚¬â„¢ÃƒÆ’Ã‚Â¢ÃƒÂ¢Ã¢â‚¬Å¡Ã‚Â¬Ãƒâ€šÃ‚Â¦ÃƒÆ’Ã†â€™Ãƒâ€šÃ‚Â¢ÃƒÆ’Ã‚Â¢ÃƒÂ¢Ã¢â€šÂ¬Ã…Â¡Ãƒâ€šÃ‚Â¬ÃƒÆ’Ã¢â‚¬Â¦ÃƒÂ¢Ã¢â€šÂ¬Ã…â€œ3), TDS levels increased in both systems, with the Monoculture treatment showing slightly higher values (around 18.6 ppt) compared to the IMTA system (approximately 18.1 ppt).</w:t>
+        <w:t>The line graph illustrates the weekly changes in Total Dissolved Solids (TDS), measured in parts per thousand (ppt), for Integrated Multi-Trophic Aquaculture (IMTA) and Monoculture treatments over a seven-week period. At the beginning of the study (Week 1), both treatments recorded identical TDS levels of approximately 16.5 ppt. During the early phase (Weeks 2ÃƒÆ’Ã†â€™Ãƒâ€ Ã¢â‚¬â„¢ÃƒÆ’Ã¢â‚¬Â ÃƒÂ¢Ã¢â€šÂ¬Ã¢â€žÂ¢ÃƒÆ’Ã†â€™ÃƒÂ¢Ã¢â€šÂ¬Ã‚Â ÃƒÆ’Ã‚Â¢ÃƒÂ¢Ã¢â‚¬Å¡Ã‚Â¬ÃƒÂ¢Ã¢â‚¬Å¾Ã‚Â¢ÃƒÆ’Ã†â€™Ãƒâ€ Ã¢â‚¬â„¢ÃƒÆ’Ã‚Â¢ÃƒÂ¢Ã¢â‚¬Å¡Ã‚Â¬Ãƒâ€šÃ‚Â ÃƒÆ’Ã†â€™Ãƒâ€šÃ‚Â¢ÃƒÆ’Ã‚Â¢ÃƒÂ¢Ã¢â€šÂ¬Ã…Â¡Ãƒâ€šÃ‚Â¬ÃƒÆ’Ã‚Â¢ÃƒÂ¢Ã¢â€šÂ¬Ã…Â¾Ãƒâ€šÃ‚Â¢ÃƒÆ’Ã†â€™Ãƒâ€ Ã¢â‚¬â„¢ÃƒÆ’Ã¢â‚¬Â ÃƒÂ¢Ã¢â€šÂ¬Ã¢â€žÂ¢ÃƒÆ’Ã†â€™Ãƒâ€šÃ‚Â¢ÃƒÆ’Ã‚Â¢ÃƒÂ¢Ã¢â€šÂ¬Ã…Â¡Ãƒâ€šÃ‚Â¬ÃƒÆ’Ã¢â‚¬Å¡Ãƒâ€šÃ‚Â ÃƒÆ’Ã†â€™Ãƒâ€ Ã¢â‚¬â„¢ÃƒÆ’Ã¢â‚¬Å¡Ãƒâ€šÃ‚Â¢ÃƒÆ’Ã†â€™Ãƒâ€šÃ‚Â¢ÃƒÆ’Ã‚Â¢ÃƒÂ¢Ã¢â‚¬Å¡Ã‚Â¬Ãƒâ€¦Ã‚Â¡ÃƒÆ’Ã¢â‚¬Å¡Ãƒâ€šÃ‚Â¬ÃƒÆ’Ã†â€™Ãƒâ€šÃ‚Â¢ÃƒÆ’Ã‚Â¢ÃƒÂ¢Ã¢â‚¬Å¡Ã‚Â¬Ãƒâ€¦Ã‚Â¾ÃƒÆ’Ã¢â‚¬Å¡Ãƒâ€šÃ‚Â¢ÃƒÆ’Ã†â€™Ãƒâ€ Ã¢â‚¬â„¢ÃƒÆ’Ã¢â‚¬Â ÃƒÂ¢Ã¢â€šÂ¬Ã¢â€žÂ¢ÃƒÆ’Ã†â€™ÃƒÂ¢Ã¢â€šÂ¬Ã‚Â ÃƒÆ’Ã‚Â¢ÃƒÂ¢Ã¢â‚¬Å¡Ã‚Â¬ÃƒÂ¢Ã¢â‚¬Å¾Ã‚Â¢ÃƒÆ’Ã†â€™Ãƒâ€ Ã¢â‚¬â„¢ÃƒÆ’Ã¢â‚¬Å¡Ãƒâ€šÃ‚Â¢ÃƒÆ’Ã†â€™Ãƒâ€šÃ‚Â¢ÃƒÆ’Ã‚Â¢ÃƒÂ¢Ã¢â‚¬Å¡Ã‚Â¬Ãƒâ€¦Ã‚Â¡ÃƒÆ’Ã¢â‚¬Å¡Ãƒâ€šÃ‚Â¬ÃƒÆ’Ã†â€™ÃƒÂ¢Ã¢â€šÂ¬Ã‚Â¦ÃƒÆ’Ã¢â‚¬Å¡Ãƒâ€šÃ‚Â¡ÃƒÆ’Ã†â€™Ãƒâ€ Ã¢â‚¬â„¢ÃƒÆ’Ã¢â‚¬Â ÃƒÂ¢Ã¢â€šÂ¬Ã¢â€žÂ¢ÃƒÆ’Ã†â€™Ãƒâ€šÃ‚Â¢ÃƒÆ’Ã‚Â¢ÃƒÂ¢Ã¢â€šÂ¬Ã…Â¡Ãƒâ€šÃ‚Â¬ÃƒÆ’Ã¢â‚¬Â¦Ãƒâ€šÃ‚Â¡ÃƒÆ’Ã†â€™Ãƒâ€ Ã¢â‚¬â„¢ÃƒÆ’Ã‚Â¢ÃƒÂ¢Ã¢â‚¬Å¡Ã‚Â¬Ãƒâ€¦Ã‚Â¡ÃƒÆ’Ã†â€™ÃƒÂ¢Ã¢â€šÂ¬Ã…Â¡ÃƒÆ’Ã¢â‚¬Å¡Ãƒâ€šÃ‚Â¢ÃƒÆ’Ã†â€™Ãƒâ€ Ã¢â‚¬â„¢ÃƒÆ’Ã¢â‚¬Â ÃƒÂ¢Ã¢â€šÂ¬Ã¢â€žÂ¢ÃƒÆ’Ã†â€™ÃƒÂ¢Ã¢â€šÂ¬Ã‚Â ÃƒÆ’Ã‚Â¢ÃƒÂ¢Ã¢â‚¬Å¡Ã‚Â¬ÃƒÂ¢Ã¢â‚¬Å¾Ã‚Â¢ÃƒÆ’Ã†â€™Ãƒâ€ Ã¢â‚¬â„¢ÃƒÆ’Ã‚Â¢ÃƒÂ¢Ã¢â‚¬Å¡Ã‚Â¬Ãƒâ€šÃ‚Â ÃƒÆ’Ã†â€™Ãƒâ€šÃ‚Â¢ÃƒÆ’Ã‚Â¢ÃƒÂ¢Ã¢â€šÂ¬Ã…Â¡Ãƒâ€šÃ‚Â¬ÃƒÆ’Ã‚Â¢ÃƒÂ¢Ã¢â€šÂ¬Ã…Â¾Ãƒâ€šÃ‚Â¢ÃƒÆ’Ã†â€™Ãƒâ€ Ã¢â‚¬â„¢ÃƒÆ’Ã¢â‚¬Â ÃƒÂ¢Ã¢â€šÂ¬Ã¢â€žÂ¢ÃƒÆ’Ã†â€™Ãƒâ€šÃ‚Â¢ÃƒÆ’Ã‚Â¢ÃƒÂ¢Ã¢â€šÂ¬Ã…Â¡Ãƒâ€šÃ‚Â¬ÃƒÆ’Ã¢â‚¬Â¦Ãƒâ€šÃ‚Â¡ÃƒÆ’Ã†â€™Ãƒâ€ Ã¢â‚¬â„¢ÃƒÆ’Ã‚Â¢ÃƒÂ¢Ã¢â‚¬Å¡Ã‚Â¬Ãƒâ€¦Ã‚Â¡ÃƒÆ’Ã†â€™ÃƒÂ¢Ã¢â€šÂ¬Ã…Â¡ÃƒÆ’Ã¢â‚¬Å¡Ãƒâ€šÃ‚Â¢ÃƒÆ’Ã†â€™Ãƒâ€ Ã¢â‚¬â„¢ÃƒÆ’Ã¢â‚¬Â ÃƒÂ¢Ã¢â€šÂ¬Ã¢â€žÂ¢ÃƒÆ’Ã†â€™ÃƒÂ¢Ã¢â€šÂ¬Ã‚Â ÃƒÆ’Ã‚Â¢ÃƒÂ¢Ã¢â‚¬Å¡Ã‚Â¬ÃƒÂ¢Ã¢â‚¬Å¾Ã‚Â¢ÃƒÆ’Ã†â€™Ãƒâ€ Ã¢â‚¬â„¢ÃƒÆ’Ã‚Â¢ÃƒÂ¢Ã¢â‚¬Å¡Ã‚Â¬Ãƒâ€¦Ã‚Â¡ÃƒÆ’Ã†â€™ÃƒÂ¢Ã¢â€šÂ¬Ã…Â¡ÃƒÆ’Ã¢â‚¬Å¡Ãƒâ€šÃ‚Â¢ÃƒÆ’Ã†â€™Ãƒâ€ Ã¢â‚¬â„¢ÃƒÆ’Ã¢â‚¬Â ÃƒÂ¢Ã¢â€šÂ¬Ã¢â€žÂ¢ÃƒÆ’Ã†â€™ÃƒÂ¢Ã¢â€šÂ¬Ã…Â¡ÃƒÆ’Ã¢â‚¬Å¡Ãƒâ€šÃ‚Â¢ÃƒÆ’Ã†â€™Ãƒâ€ Ã¢â‚¬â„¢ÃƒÆ’Ã¢â‚¬Å¡Ãƒâ€šÃ‚Â¢ÃƒÆ’Ã†â€™Ãƒâ€šÃ‚Â¢ÃƒÆ’Ã‚Â¢ÃƒÂ¢Ã¢â‚¬Å¡Ã‚Â¬Ãƒâ€¦Ã‚Â¡ÃƒÆ’Ã¢â‚¬Å¡Ãƒâ€šÃ‚Â¬ÃƒÆ’Ã†â€™ÃƒÂ¢Ã¢â€šÂ¬Ã‚Â¦ÃƒÆ’Ã¢â‚¬Å¡Ãƒâ€šÃ‚Â¡ÃƒÆ’Ã†â€™Ãƒâ€ Ã¢â‚¬â„¢ÃƒÆ’Ã‚Â¢ÃƒÂ¢Ã¢â‚¬Å¡Ã‚Â¬Ãƒâ€¦Ã‚Â¡ÃƒÆ’Ã†â€™ÃƒÂ¢Ã¢â€šÂ¬Ã…Â¡ÃƒÆ’Ã¢â‚¬Å¡Ãƒâ€šÃ‚Â¬ÃƒÆ’Ã†â€™Ãƒâ€ Ã¢â‚¬â„¢ÃƒÆ’Ã¢â‚¬Â ÃƒÂ¢Ã¢â€šÂ¬Ã¢â€žÂ¢ÃƒÆ’Ã†â€™Ãƒâ€šÃ‚Â¢ÃƒÆ’Ã‚Â¢ÃƒÂ¢Ã¢â€šÂ¬Ã…Â¡Ãƒâ€šÃ‚Â¬ÃƒÆ’Ã¢â‚¬Å¡Ãƒâ€šÃ‚Â¦ÃƒÆ’Ã†â€™Ãƒâ€ Ã¢â‚¬â„¢ÃƒÆ’Ã‚Â¢ÃƒÂ¢Ã¢â‚¬Å¡Ã‚Â¬Ãƒâ€¦Ã‚Â¡ÃƒÆ’Ã†â€™ÃƒÂ¢Ã¢â€šÂ¬Ã…Â¡ÃƒÆ’Ã¢â‚¬Å¡Ãƒâ€šÃ‚Â¡ÃƒÆ’Ã†â€™Ãƒâ€ Ã¢â‚¬â„¢ÃƒÆ’Ã¢â‚¬Â ÃƒÂ¢Ã¢â€šÂ¬Ã¢â€žÂ¢ÃƒÆ’Ã†â€™ÃƒÂ¢Ã¢â€šÂ¬Ã‚Â ÃƒÆ’Ã‚Â¢ÃƒÂ¢Ã¢â‚¬Å¡Ã‚Â¬ÃƒÂ¢Ã¢â‚¬Å¾Ã‚Â¢ÃƒÆ’Ã†â€™Ãƒâ€ Ã¢â‚¬â„¢ÃƒÆ’Ã¢â‚¬Å¡Ãƒâ€šÃ‚Â¢ÃƒÆ’Ã†â€™Ãƒâ€šÃ‚Â¢ÃƒÆ’Ã‚Â¢ÃƒÂ¢Ã¢â‚¬Å¡Ã‚Â¬Ãƒâ€¦Ã‚Â¡ÃƒÆ’Ã¢â‚¬Å¡Ãƒâ€šÃ‚Â¬ÃƒÆ’Ã†â€™ÃƒÂ¢Ã¢â€šÂ¬Ã‚Â¦ÃƒÆ’Ã¢â‚¬Å¡Ãƒâ€šÃ‚Â¡ÃƒÆ’Ã†â€™Ãƒâ€ Ã¢â‚¬â„¢ÃƒÆ’Ã¢â‚¬Â ÃƒÂ¢Ã¢â€šÂ¬Ã¢â€žÂ¢ÃƒÆ’Ã†â€™Ãƒâ€šÃ‚Â¢ÃƒÆ’Ã‚Â¢ÃƒÂ¢Ã¢â€šÂ¬Ã…Â¡Ãƒâ€šÃ‚Â¬ÃƒÆ’Ã¢â‚¬Â¦Ãƒâ€šÃ‚Â¡ÃƒÆ’Ã†â€™Ãƒâ€ Ã¢â‚¬â„¢ÃƒÆ’Ã‚Â¢ÃƒÂ¢Ã¢â‚¬Å¡Ã‚Â¬Ãƒâ€¦Ã‚Â¡ÃƒÆ’Ã†â€™ÃƒÂ¢Ã¢â€šÂ¬Ã…Â¡ÃƒÆ’Ã¢â‚¬Å¡Ãƒâ€šÃ‚Â¬ÃƒÆ’Ã†â€™Ãƒâ€ Ã¢â‚¬â„¢ÃƒÆ’Ã¢â‚¬Â ÃƒÂ¢Ã¢â€šÂ¬Ã¢â€žÂ¢ÃƒÆ’Ã†â€™ÃƒÂ¢Ã¢â€šÂ¬Ã‚Â ÃƒÆ’Ã‚Â¢ÃƒÂ¢Ã¢â‚¬Å¡Ã‚Â¬ÃƒÂ¢Ã¢â‚¬Å¾Ã‚Â¢ÃƒÆ’Ã†â€™Ãƒâ€ Ã¢â‚¬â„¢ÃƒÆ’Ã‚Â¢ÃƒÂ¢Ã¢â‚¬Å¡Ã‚Â¬Ãƒâ€šÃ‚Â ÃƒÆ’Ã†â€™Ãƒâ€šÃ‚Â¢ÃƒÆ’Ã‚Â¢ÃƒÂ¢Ã¢â€šÂ¬Ã…Â¡Ãƒâ€šÃ‚Â¬ÃƒÆ’Ã‚Â¢ÃƒÂ¢Ã¢â€šÂ¬Ã…Â¾Ãƒâ€šÃ‚Â¢ÃƒÆ’Ã†â€™Ãƒâ€ Ã¢â‚¬â„¢ÃƒÆ’Ã¢â‚¬Â ÃƒÂ¢Ã¢â€šÂ¬Ã¢â€žÂ¢ÃƒÆ’Ã†â€™Ãƒâ€šÃ‚Â¢ÃƒÆ’Ã‚Â¢ÃƒÂ¢Ã¢â€šÂ¬Ã…Â¡Ãƒâ€šÃ‚Â¬ÃƒÆ’Ã¢â‚¬Â¦Ãƒâ€šÃ‚Â¡ÃƒÆ’Ã†â€™Ãƒâ€ Ã¢â‚¬â„¢ÃƒÆ’Ã‚Â¢ÃƒÂ¢Ã¢â‚¬Å¡Ã‚Â¬Ãƒâ€¦Ã‚Â¡ÃƒÆ’Ã†â€™ÃƒÂ¢Ã¢â€šÂ¬Ã…Â¡ÃƒÆ’Ã¢â‚¬Å¡Ãƒâ€šÃ‚Â¢ÃƒÆ’Ã†â€™Ãƒâ€ Ã¢â‚¬â„¢ÃƒÆ’Ã¢â‚¬Â ÃƒÂ¢Ã¢â€šÂ¬Ã¢â€žÂ¢ÃƒÆ’Ã†â€™ÃƒÂ¢Ã¢â€šÂ¬Ã‚Â ÃƒÆ’Ã‚Â¢ÃƒÂ¢Ã¢â‚¬Å¡Ã‚Â¬ÃƒÂ¢Ã¢â‚¬Å¾Ã‚Â¢ÃƒÆ’Ã†â€™Ãƒâ€ Ã¢â‚¬â„¢ÃƒÆ’Ã‚Â¢ÃƒÂ¢Ã¢â‚¬Å¡Ã‚Â¬Ãƒâ€¦Ã‚Â¡ÃƒÆ’Ã†â€™ÃƒÂ¢Ã¢â€šÂ¬Ã…Â¡ÃƒÆ’Ã¢â‚¬Å¡Ãƒâ€šÃ‚Â¢ÃƒÆ’Ã†â€™Ãƒâ€ Ã¢â‚¬â„¢ÃƒÆ’Ã¢â‚¬Â ÃƒÂ¢Ã¢â€šÂ¬Ã¢â€žÂ¢ÃƒÆ’Ã†â€™ÃƒÂ¢Ã¢â€šÂ¬Ã…Â¡ÃƒÆ’Ã¢â‚¬Å¡Ãƒâ€šÃ‚Â¢ÃƒÆ’Ã†â€™Ãƒâ€ Ã¢â‚¬â„¢ÃƒÆ’Ã¢â‚¬Å¡Ãƒâ€šÃ‚Â¢ÃƒÆ’Ã†â€™Ãƒâ€šÃ‚Â¢ÃƒÆ’Ã‚Â¢ÃƒÂ¢Ã¢â€šÂ¬Ã…Â¡Ãƒâ€šÃ‚Â¬ÃƒÆ’Ã¢â‚¬Â¦Ãƒâ€šÃ‚Â¡ÃƒÆ’Ã†â€™ÃƒÂ¢Ã¢â€šÂ¬Ã…Â¡ÃƒÆ’Ã¢â‚¬Å¡Ãƒâ€šÃ‚Â¬ÃƒÆ’Ã†â€™Ãƒâ€ Ã¢â‚¬â„¢ÃƒÆ’Ã‚Â¢ÃƒÂ¢Ã¢â‚¬Å¡Ã‚Â¬Ãƒâ€šÃ‚Â¦ÃƒÆ’Ã†â€™ÃƒÂ¢Ã¢â€šÂ¬Ã…Â¡ÃƒÆ’Ã¢â‚¬Å¡Ãƒâ€šÃ‚Â¡ÃƒÆ’Ã†â€™Ãƒâ€ Ã¢â‚¬â„¢ÃƒÆ’Ã¢â‚¬Â ÃƒÂ¢Ã¢â€šÂ¬Ã¢â€žÂ¢ÃƒÆ’Ã†â€™Ãƒâ€šÃ‚Â¢ÃƒÆ’Ã‚Â¢ÃƒÂ¢Ã¢â€šÂ¬Ã…Â¡Ãƒâ€šÃ‚Â¬ÃƒÆ’Ã¢â‚¬Â¦Ãƒâ€šÃ‚Â¡ÃƒÆ’Ã†â€™Ãƒâ€ Ã¢â‚¬â„¢ÃƒÆ’Ã‚Â¢ÃƒÂ¢Ã¢â‚¬Å¡Ã‚Â¬Ãƒâ€¦Ã‚Â¡ÃƒÆ’Ã†â€™ÃƒÂ¢Ã¢â€šÂ¬Ã…Â¡ÃƒÆ’Ã¢â‚¬Å¡Ãƒâ€šÃ‚Â¬ÃƒÆ’Ã†â€™Ãƒâ€ Ã¢â‚¬â„¢ÃƒÆ’Ã¢â‚¬Â ÃƒÂ¢Ã¢â€šÂ¬Ã¢â€žÂ¢ÃƒÆ’Ã†â€™ÃƒÂ¢Ã¢â€šÂ¬Ã‚Â ÃƒÆ’Ã‚Â¢ÃƒÂ¢Ã¢â‚¬Å¡Ã‚Â¬ÃƒÂ¢Ã¢â‚¬Å¾Ã‚Â¢ÃƒÆ’Ã†â€™Ãƒâ€ Ã¢â‚¬â„¢ÃƒÆ’Ã¢â‚¬Å¡Ãƒâ€šÃ‚Â¢ÃƒÆ’Ã†â€™Ãƒâ€šÃ‚Â¢ÃƒÆ’Ã‚Â¢ÃƒÂ¢Ã¢â‚¬Å¡Ã‚Â¬Ãƒâ€¦Ã‚Â¡ÃƒÆ’Ã¢â‚¬Å¡Ãƒâ€šÃ‚Â¬ÃƒÆ’Ã†â€™ÃƒÂ¢Ã¢â€šÂ¬Ã…Â¡ÃƒÆ’Ã¢â‚¬Å¡Ãƒâ€šÃ‚Â¦ÃƒÆ’Ã†â€™Ãƒâ€ Ã¢â‚¬â„¢ÃƒÆ’Ã¢â‚¬Â ÃƒÂ¢Ã¢â€šÂ¬Ã¢â€žÂ¢ÃƒÆ’Ã†â€™ÃƒÂ¢Ã¢â€šÂ¬Ã…Â¡ÃƒÆ’Ã¢â‚¬Å¡Ãƒâ€šÃ‚Â¢ÃƒÆ’Ã†â€™Ãƒâ€ Ã¢â‚¬â„¢ÃƒÆ’Ã¢â‚¬Å¡Ãƒâ€šÃ‚Â¢ÃƒÆ’Ã†â€™Ãƒâ€šÃ‚Â¢ÃƒÆ’Ã‚Â¢ÃƒÂ¢Ã¢â€šÂ¬Ã…Â¡Ãƒâ€šÃ‚Â¬ÃƒÆ’Ã¢â‚¬Â¦Ãƒâ€šÃ‚Â¡ÃƒÆ’Ã†â€™ÃƒÂ¢Ã¢â€šÂ¬Ã…Â¡ÃƒÆ’Ã¢â‚¬Å¡Ãƒâ€šÃ‚Â¬ÃƒÆ’Ã†â€™Ãƒâ€ Ã¢â‚¬â„¢ÃƒÆ’Ã‚Â¢ÃƒÂ¢Ã¢â‚¬Å¡Ã‚Â¬Ãƒâ€šÃ‚Â¦ÃƒÆ’Ã†â€™Ãƒâ€šÃ‚Â¢ÃƒÆ’Ã‚Â¢ÃƒÂ¢Ã¢â€šÂ¬Ã…Â¡Ãƒâ€šÃ‚Â¬ÃƒÆ’Ã¢â‚¬Â¦ÃƒÂ¢Ã¢â€šÂ¬Ã…â€œ3), TDS levels increased in both systems, with the Monoculture treatment showing slightly higher values (around 18.6 ppt) compared to the IMTA system (approximately 18.1 ppt).</w:t>
       </w:r>
     </w:p>
     <w:p>
@@ -6525,21 +6525,21 @@
         <w:rPr>
           <w:rFonts w:ascii="Times New Roman" w:hAnsi="Times New Roman" w:cs="Times New Roman"/>
         </w:rPr>
-        <w:t>The line graph illustrates the weekly changes in salinity levels (measured in ppt) for Integrated Multi-Trophic Aquaculture (IMTA) and Monoculture treatments over a seven-week period. At the start of the study (Week 1), both treatments recorded identical salinity levels of approximately 20.6 ppt. During the early phase (Weeks 2ÃƒÆ’Ã†â€™Ãƒâ€ Ã¢â‚¬â„¢ÃƒÆ’Ã¢â‚¬Â ÃƒÂ¢Ã¢â€šÂ¬Ã¢â€žÂ¢ÃƒÆ’Ã†â€™ÃƒÂ¢Ã¢â€šÂ¬Ã‚Â ÃƒÆ’Ã‚Â¢ÃƒÂ¢Ã¢â‚¬Å¡Ã‚Â¬ÃƒÂ¢Ã¢â‚¬Å¾Ã‚Â¢ÃƒÆ’Ã†â€™Ãƒâ€ Ã¢â‚¬â„¢ÃƒÆ’Ã‚Â¢ÃƒÂ¢Ã¢â‚¬Å¡Ã‚Â¬Ãƒâ€¦Ã‚Â¡ÃƒÆ’Ã†â€™ÃƒÂ¢Ã¢â€šÂ¬Ã…Â¡ÃƒÆ’Ã¢â‚¬Å¡Ãƒâ€šÃ‚Â¢ÃƒÆ’Ã†â€™Ãƒâ€ Ã¢â‚¬â„¢ÃƒÆ’Ã¢â‚¬Â ÃƒÂ¢Ã¢â€šÂ¬Ã¢â€žÂ¢ÃƒÆ’Ã†â€™ÃƒÂ¢Ã¢â€šÂ¬Ã…Â¡ÃƒÆ’Ã¢â‚¬Å¡Ãƒâ€šÃ‚Â¢ÃƒÆ’Ã†â€™Ãƒâ€ Ã¢â‚¬â„¢ÃƒÆ’Ã¢â‚¬Å¡Ãƒâ€šÃ‚Â¢ÃƒÆ’Ã†â€™Ãƒâ€šÃ‚Â¢ÃƒÆ’Ã‚Â¢ÃƒÂ¢Ã¢â‚¬Å¡Ã‚Â¬Ãƒâ€¦Ã‚Â¡ÃƒÆ’Ã¢â‚¬Å¡Ãƒâ€šÃ‚Â¬ÃƒÆ’Ã†â€™ÃƒÂ¢Ã¢â€šÂ¬Ã‚Â¦ÃƒÆ’Ã¢â‚¬Å¡Ãƒâ€šÃ‚Â¡ÃƒÆ’Ã†â€™Ãƒâ€ Ã¢â‚¬â„¢ÃƒÆ’Ã‚Â¢ÃƒÂ¢Ã¢â‚¬Å¡Ã‚Â¬Ãƒâ€¦Ã‚Â¡ÃƒÆ’Ã†â€™ÃƒÂ¢Ã¢â€šÂ¬Ã…Â¡ÃƒÆ’Ã¢â‚¬Å¡Ãƒâ€šÃ‚Â¬ÃƒÆ’Ã†â€™Ãƒâ€ Ã¢â‚¬â„¢ÃƒÆ’Ã¢â‚¬Â ÃƒÂ¢Ã¢â€šÂ¬Ã¢â€žÂ¢ÃƒÆ’Ã†â€™ÃƒÂ¢Ã¢â€šÂ¬Ã…Â¡ÃƒÆ’Ã¢â‚¬Å¡Ãƒâ€šÃ‚Â¢ÃƒÆ’Ã†â€™Ãƒâ€ Ã¢â‚¬â„¢ÃƒÆ’Ã¢â‚¬Å¡Ãƒâ€šÃ‚Â¢ÃƒÆ’Ã†â€™Ãƒâ€šÃ‚Â¢ÃƒÆ’Ã‚Â¢ÃƒÂ¢Ã¢â€šÂ¬Ã…Â¡Ãƒâ€šÃ‚Â¬ÃƒÆ’Ã¢â‚¬Â¦Ãƒâ€šÃ‚Â¡ÃƒÆ’Ã†â€™ÃƒÂ¢Ã¢â€šÂ¬Ã…Â¡ÃƒÆ’Ã¢â‚¬Å¡Ãƒâ€šÃ‚Â¬ÃƒÆ’Ã†â€™Ãƒâ€ Ã¢â‚¬â„¢ÃƒÆ’Ã‚Â¢ÃƒÂ¢Ã¢â‚¬Å¡Ã‚Â¬Ãƒâ€šÃ‚Â¦ÃƒÆ’Ã†â€™Ãƒâ€šÃ‚Â¢ÃƒÆ’Ã‚Â¢ÃƒÂ¢Ã¢â€šÂ¬Ã…Â¡Ãƒâ€šÃ‚Â¬ÃƒÆ’Ã¢â‚¬Â¦ÃƒÂ¢Ã¢â€šÂ¬Ã…â€œ3), salinity increased in both systems; however, the Monoculture treatment consistently showed higher values (around 23.5 ppt) compared to the IMTA system (approximately 22.9 ppt).</w:t>
-      </w:r>
-    </w:p>
-    <w:p>
-      <w:pPr>
-        <w:spacing w:line="360" w:lineRule="auto"/>
-        <w:rPr>
-          <w:rFonts w:ascii="Times New Roman" w:hAnsi="Times New Roman" w:cs="Times New Roman"/>
-        </w:rPr>
-      </w:pPr>
-      <w:r>
-        <w:rPr>
-          <w:rFonts w:ascii="Times New Roman" w:hAnsi="Times New Roman" w:cs="Times New Roman"/>
-        </w:rPr>
-        <w:t xml:space="preserve">In the mid-phase of the study (Weeks 4ÃƒÆ’Ã†â€™Ãƒâ€ Ã¢â‚¬â„¢ÃƒÆ’Ã¢â‚¬Â ÃƒÂ¢Ã¢â€šÂ¬Ã¢â€žÂ¢ÃƒÆ’Ã†â€™ÃƒÂ¢Ã¢â€šÂ¬Ã‚Â ÃƒÆ’Ã‚Â¢ÃƒÂ¢Ã¢â‚¬Å¡Ã‚Â¬ÃƒÂ¢Ã¢â‚¬Å¾Ã‚Â¢ÃƒÆ’Ã†â€™Ãƒâ€ Ã¢â‚¬â„¢ÃƒÆ’Ã‚Â¢ÃƒÂ¢Ã¢â‚¬Å¡Ã‚Â¬Ãƒâ€¦Ã‚Â¡ÃƒÆ’Ã†â€™ÃƒÂ¢Ã¢â€šÂ¬Ã…Â¡ÃƒÆ’Ã¢â‚¬Å¡Ãƒâ€šÃ‚Â¢ÃƒÆ’Ã†â€™Ãƒâ€ Ã¢â‚¬â„¢ÃƒÆ’Ã¢â‚¬Â ÃƒÂ¢Ã¢â€šÂ¬Ã¢â€žÂ¢ÃƒÆ’Ã†â€™ÃƒÂ¢Ã¢â€šÂ¬Ã…Â¡ÃƒÆ’Ã¢â‚¬Å¡Ãƒâ€šÃ‚Â¢ÃƒÆ’Ã†â€™Ãƒâ€ Ã¢â‚¬â„¢ÃƒÆ’Ã¢â‚¬Å¡Ãƒâ€šÃ‚Â¢ÃƒÆ’Ã†â€™Ãƒâ€šÃ‚Â¢ÃƒÆ’Ã‚Â¢ÃƒÂ¢Ã¢â‚¬Å¡Ã‚Â¬Ãƒâ€¦Ã‚Â¡ÃƒÆ’Ã¢â‚¬Å¡Ãƒâ€šÃ‚Â¬ÃƒÆ’Ã†â€™ÃƒÂ¢Ã¢â€šÂ¬Ã‚Â¦ÃƒÆ’Ã¢â‚¬Å¡Ãƒâ€šÃ‚Â¡ÃƒÆ’Ã†â€™Ãƒâ€ Ã¢â‚¬â„¢ÃƒÆ’Ã‚Â¢ÃƒÂ¢Ã¢â‚¬Å¡Ã‚Â¬Ãƒâ€¦Ã‚Â¡ÃƒÆ’Ã†â€™ÃƒÂ¢Ã¢â€šÂ¬Ã…Â¡ÃƒÆ’Ã¢â‚¬Å¡Ãƒâ€šÃ‚Â¬ÃƒÆ’Ã†â€™Ãƒâ€ Ã¢â‚¬â„¢ÃƒÆ’Ã¢â‚¬Â ÃƒÂ¢Ã¢â€šÂ¬Ã¢â€žÂ¢ÃƒÆ’Ã†â€™ÃƒÂ¢Ã¢â€šÂ¬Ã…Â¡ÃƒÆ’Ã¢â‚¬Å¡Ãƒâ€šÃ‚Â¢ÃƒÆ’Ã†â€™Ãƒâ€ Ã¢â‚¬â„¢ÃƒÆ’Ã¢â‚¬Å¡Ãƒâ€šÃ‚Â¢ÃƒÆ’Ã†â€™Ãƒâ€šÃ‚Â¢ÃƒÆ’Ã‚Â¢ÃƒÂ¢Ã¢â€šÂ¬Ã…Â¡Ãƒâ€šÃ‚Â¬ÃƒÆ’Ã¢â‚¬Â¦Ãƒâ€šÃ‚Â¡ÃƒÆ’Ã†â€™ÃƒÂ¢Ã¢â€šÂ¬Ã…Â¡ÃƒÆ’Ã¢â‚¬Å¡Ãƒâ€šÃ‚Â¬ÃƒÆ’Ã†â€™Ãƒâ€ Ã¢â‚¬â„¢ÃƒÆ’Ã‚Â¢ÃƒÂ¢Ã¢â‚¬Å¡Ã‚Â¬Ãƒâ€šÃ‚Â¦ÃƒÆ’Ã†â€™Ãƒâ€šÃ‚Â¢ÃƒÆ’Ã‚Â¢ÃƒÂ¢Ã¢â€šÂ¬Ã…Â¡Ãƒâ€šÃ‚Â¬ÃƒÆ’Ã¢â‚¬Â¦ÃƒÂ¢Ã¢â€šÂ¬Ã…â€œ5), the salinity levels of both treatments briefly converged at about 21.5 ppt in Week 4. This was followed by a notable divergence in Week 5, where Monoculture salinity increased sharply to approximately 24.0 ppt, while the IMTA system </w:t>
+        <w:t>The line graph illustrates the weekly changes in salinity levels (measured in ppt) for Integrated Multi-Trophic Aquaculture (IMTA) and Monoculture treatments over a seven-week period. At the start of the study (Week 1), both treatments recorded identical salinity levels of approximately 20.6 ppt. During the early phase (Weeks 2ÃƒÆ’Ã†â€™Ãƒâ€ Ã¢â‚¬â„¢ÃƒÆ’Ã¢â‚¬Â ÃƒÂ¢Ã¢â€šÂ¬Ã¢â€žÂ¢ÃƒÆ’Ã†â€™ÃƒÂ¢Ã¢â€šÂ¬Ã‚Â ÃƒÆ’Ã‚Â¢ÃƒÂ¢Ã¢â‚¬Å¡Ã‚Â¬ÃƒÂ¢Ã¢â‚¬Å¾Ã‚Â¢ÃƒÆ’Ã†â€™Ãƒâ€ Ã¢â‚¬â„¢ÃƒÆ’Ã‚Â¢ÃƒÂ¢Ã¢â‚¬Å¡Ã‚Â¬Ãƒâ€šÃ‚Â ÃƒÆ’Ã†â€™Ãƒâ€šÃ‚Â¢ÃƒÆ’Ã‚Â¢ÃƒÂ¢Ã¢â€šÂ¬Ã…Â¡Ãƒâ€šÃ‚Â¬ÃƒÆ’Ã‚Â¢ÃƒÂ¢Ã¢â€šÂ¬Ã…Â¾Ãƒâ€šÃ‚Â¢ÃƒÆ’Ã†â€™Ãƒâ€ Ã¢â‚¬â„¢ÃƒÆ’Ã¢â‚¬Â ÃƒÂ¢Ã¢â€šÂ¬Ã¢â€žÂ¢ÃƒÆ’Ã†â€™Ãƒâ€šÃ‚Â¢ÃƒÆ’Ã‚Â¢ÃƒÂ¢Ã¢â€šÂ¬Ã…Â¡Ãƒâ€šÃ‚Â¬ÃƒÆ’Ã¢â‚¬Å¡Ãƒâ€šÃ‚Â ÃƒÆ’Ã†â€™Ãƒâ€ Ã¢â‚¬â„¢ÃƒÆ’Ã¢â‚¬Å¡Ãƒâ€šÃ‚Â¢ÃƒÆ’Ã†â€™Ãƒâ€šÃ‚Â¢ÃƒÆ’Ã‚Â¢ÃƒÂ¢Ã¢â‚¬Å¡Ã‚Â¬Ãƒâ€¦Ã‚Â¡ÃƒÆ’Ã¢â‚¬Å¡Ãƒâ€šÃ‚Â¬ÃƒÆ’Ã†â€™Ãƒâ€šÃ‚Â¢ÃƒÆ’Ã‚Â¢ÃƒÂ¢Ã¢â‚¬Å¡Ã‚Â¬Ãƒâ€¦Ã‚Â¾ÃƒÆ’Ã¢â‚¬Å¡Ãƒâ€šÃ‚Â¢ÃƒÆ’Ã†â€™Ãƒâ€ Ã¢â‚¬â„¢ÃƒÆ’Ã¢â‚¬Â ÃƒÂ¢Ã¢â€šÂ¬Ã¢â€žÂ¢ÃƒÆ’Ã†â€™ÃƒÂ¢Ã¢â€šÂ¬Ã‚Â ÃƒÆ’Ã‚Â¢ÃƒÂ¢Ã¢â‚¬Å¡Ã‚Â¬ÃƒÂ¢Ã¢â‚¬Å¾Ã‚Â¢ÃƒÆ’Ã†â€™Ãƒâ€ Ã¢â‚¬â„¢ÃƒÆ’Ã¢â‚¬Å¡Ãƒâ€šÃ‚Â¢ÃƒÆ’Ã†â€™Ãƒâ€šÃ‚Â¢ÃƒÆ’Ã‚Â¢ÃƒÂ¢Ã¢â‚¬Å¡Ã‚Â¬Ãƒâ€¦Ã‚Â¡ÃƒÆ’Ã¢â‚¬Å¡Ãƒâ€šÃ‚Â¬ÃƒÆ’Ã†â€™ÃƒÂ¢Ã¢â€šÂ¬Ã‚Â¦ÃƒÆ’Ã¢â‚¬Å¡Ãƒâ€šÃ‚Â¡ÃƒÆ’Ã†â€™Ãƒâ€ Ã¢â‚¬â„¢ÃƒÆ’Ã¢â‚¬Â ÃƒÂ¢Ã¢â€šÂ¬Ã¢â€žÂ¢ÃƒÆ’Ã†â€™Ãƒâ€šÃ‚Â¢ÃƒÆ’Ã‚Â¢ÃƒÂ¢Ã¢â€šÂ¬Ã…Â¡Ãƒâ€šÃ‚Â¬ÃƒÆ’Ã¢â‚¬Â¦Ãƒâ€šÃ‚Â¡ÃƒÆ’Ã†â€™Ãƒâ€ Ã¢â‚¬â„¢ÃƒÆ’Ã‚Â¢ÃƒÂ¢Ã¢â‚¬Å¡Ã‚Â¬Ãƒâ€¦Ã‚Â¡ÃƒÆ’Ã†â€™ÃƒÂ¢Ã¢â€šÂ¬Ã…Â¡ÃƒÆ’Ã¢â‚¬Å¡Ãƒâ€šÃ‚Â¢ÃƒÆ’Ã†â€™Ãƒâ€ Ã¢â‚¬â„¢ÃƒÆ’Ã¢â‚¬Â ÃƒÂ¢Ã¢â€šÂ¬Ã¢â€žÂ¢ÃƒÆ’Ã†â€™ÃƒÂ¢Ã¢â€šÂ¬Ã‚Â ÃƒÆ’Ã‚Â¢ÃƒÂ¢Ã¢â‚¬Å¡Ã‚Â¬ÃƒÂ¢Ã¢â‚¬Å¾Ã‚Â¢ÃƒÆ’Ã†â€™Ãƒâ€ Ã¢â‚¬â„¢ÃƒÆ’Ã‚Â¢ÃƒÂ¢Ã¢â‚¬Å¡Ã‚Â¬Ãƒâ€šÃ‚Â ÃƒÆ’Ã†â€™Ãƒâ€šÃ‚Â¢ÃƒÆ’Ã‚Â¢ÃƒÂ¢Ã¢â€šÂ¬Ã…Â¡Ãƒâ€šÃ‚Â¬ÃƒÆ’Ã‚Â¢ÃƒÂ¢Ã¢â€šÂ¬Ã…Â¾Ãƒâ€šÃ‚Â¢ÃƒÆ’Ã†â€™Ãƒâ€ Ã¢â‚¬â„¢ÃƒÆ’Ã¢â‚¬Â ÃƒÂ¢Ã¢â€šÂ¬Ã¢â€žÂ¢ÃƒÆ’Ã†â€™Ãƒâ€šÃ‚Â¢ÃƒÆ’Ã‚Â¢ÃƒÂ¢Ã¢â€šÂ¬Ã…Â¡Ãƒâ€šÃ‚Â¬ÃƒÆ’Ã¢â‚¬Â¦Ãƒâ€šÃ‚Â¡ÃƒÆ’Ã†â€™Ãƒâ€ Ã¢â‚¬â„¢ÃƒÆ’Ã‚Â¢ÃƒÂ¢Ã¢â‚¬Å¡Ã‚Â¬Ãƒâ€¦Ã‚Â¡ÃƒÆ’Ã†â€™ÃƒÂ¢Ã¢â€šÂ¬Ã…Â¡ÃƒÆ’Ã¢â‚¬Å¡Ãƒâ€šÃ‚Â¢ÃƒÆ’Ã†â€™Ãƒâ€ Ã¢â‚¬â„¢ÃƒÆ’Ã¢â‚¬Â ÃƒÂ¢Ã¢â€šÂ¬Ã¢â€žÂ¢ÃƒÆ’Ã†â€™ÃƒÂ¢Ã¢â€šÂ¬Ã‚Â ÃƒÆ’Ã‚Â¢ÃƒÂ¢Ã¢â‚¬Å¡Ã‚Â¬ÃƒÂ¢Ã¢â‚¬Å¾Ã‚Â¢ÃƒÆ’Ã†â€™Ãƒâ€ Ã¢â‚¬â„¢ÃƒÆ’Ã‚Â¢ÃƒÂ¢Ã¢â‚¬Å¡Ã‚Â¬Ãƒâ€¦Ã‚Â¡ÃƒÆ’Ã†â€™ÃƒÂ¢Ã¢â€šÂ¬Ã…Â¡ÃƒÆ’Ã¢â‚¬Å¡Ãƒâ€šÃ‚Â¢ÃƒÆ’Ã†â€™Ãƒâ€ Ã¢â‚¬â„¢ÃƒÆ’Ã¢â‚¬Â ÃƒÂ¢Ã¢â€šÂ¬Ã¢â€žÂ¢ÃƒÆ’Ã†â€™ÃƒÂ¢Ã¢â€šÂ¬Ã…Â¡ÃƒÆ’Ã¢â‚¬Å¡Ãƒâ€šÃ‚Â¢ÃƒÆ’Ã†â€™Ãƒâ€ Ã¢â‚¬â„¢ÃƒÆ’Ã¢â‚¬Å¡Ãƒâ€šÃ‚Â¢ÃƒÆ’Ã†â€™Ãƒâ€šÃ‚Â¢ÃƒÆ’Ã‚Â¢ÃƒÂ¢Ã¢â‚¬Å¡Ã‚Â¬Ãƒâ€¦Ã‚Â¡ÃƒÆ’Ã¢â‚¬Å¡Ãƒâ€šÃ‚Â¬ÃƒÆ’Ã†â€™ÃƒÂ¢Ã¢â€šÂ¬Ã‚Â¦ÃƒÆ’Ã¢â‚¬Å¡Ãƒâ€šÃ‚Â¡ÃƒÆ’Ã†â€™Ãƒâ€ Ã¢â‚¬â„¢ÃƒÆ’Ã‚Â¢ÃƒÂ¢Ã¢â‚¬Å¡Ã‚Â¬Ãƒâ€¦Ã‚Â¡ÃƒÆ’Ã†â€™ÃƒÂ¢Ã¢â€šÂ¬Ã…Â¡ÃƒÆ’Ã¢â‚¬Å¡Ãƒâ€šÃ‚Â¬ÃƒÆ’Ã†â€™Ãƒâ€ Ã¢â‚¬â„¢ÃƒÆ’Ã¢â‚¬Â ÃƒÂ¢Ã¢â€šÂ¬Ã¢â€žÂ¢ÃƒÆ’Ã†â€™Ãƒâ€šÃ‚Â¢ÃƒÆ’Ã‚Â¢ÃƒÂ¢Ã¢â€šÂ¬Ã…Â¡Ãƒâ€šÃ‚Â¬ÃƒÆ’Ã¢â‚¬Å¡Ãƒâ€šÃ‚Â¦ÃƒÆ’Ã†â€™Ãƒâ€ Ã¢â‚¬â„¢ÃƒÆ’Ã‚Â¢ÃƒÂ¢Ã¢â‚¬Å¡Ã‚Â¬Ãƒâ€¦Ã‚Â¡ÃƒÆ’Ã†â€™ÃƒÂ¢Ã¢â€šÂ¬Ã…Â¡ÃƒÆ’Ã¢â‚¬Å¡Ãƒâ€šÃ‚Â¡ÃƒÆ’Ã†â€™Ãƒâ€ Ã¢â‚¬â„¢ÃƒÆ’Ã¢â‚¬Â ÃƒÂ¢Ã¢â€šÂ¬Ã¢â€žÂ¢ÃƒÆ’Ã†â€™ÃƒÂ¢Ã¢â€šÂ¬Ã‚Â ÃƒÆ’Ã‚Â¢ÃƒÂ¢Ã¢â‚¬Å¡Ã‚Â¬ÃƒÂ¢Ã¢â‚¬Å¾Ã‚Â¢ÃƒÆ’Ã†â€™Ãƒâ€ Ã¢â‚¬â„¢ÃƒÆ’Ã¢â‚¬Å¡Ãƒâ€šÃ‚Â¢ÃƒÆ’Ã†â€™Ãƒâ€šÃ‚Â¢ÃƒÆ’Ã‚Â¢ÃƒÂ¢Ã¢â‚¬Å¡Ã‚Â¬Ãƒâ€¦Ã‚Â¡ÃƒÆ’Ã¢â‚¬Å¡Ãƒâ€šÃ‚Â¬ÃƒÆ’Ã†â€™ÃƒÂ¢Ã¢â€šÂ¬Ã‚Â¦ÃƒÆ’Ã¢â‚¬Å¡Ãƒâ€šÃ‚Â¡ÃƒÆ’Ã†â€™Ãƒâ€ Ã¢â‚¬â„¢ÃƒÆ’Ã¢â‚¬Â ÃƒÂ¢Ã¢â€šÂ¬Ã¢â€žÂ¢ÃƒÆ’Ã†â€™Ãƒâ€šÃ‚Â¢ÃƒÆ’Ã‚Â¢ÃƒÂ¢Ã¢â€šÂ¬Ã…Â¡Ãƒâ€šÃ‚Â¬ÃƒÆ’Ã¢â‚¬Â¦Ãƒâ€šÃ‚Â¡ÃƒÆ’Ã†â€™Ãƒâ€ Ã¢â‚¬â„¢ÃƒÆ’Ã‚Â¢ÃƒÂ¢Ã¢â‚¬Å¡Ã‚Â¬Ãƒâ€¦Ã‚Â¡ÃƒÆ’Ã†â€™ÃƒÂ¢Ã¢â€šÂ¬Ã…Â¡ÃƒÆ’Ã¢â‚¬Å¡Ãƒâ€šÃ‚Â¬ÃƒÆ’Ã†â€™Ãƒâ€ Ã¢â‚¬â„¢ÃƒÆ’Ã¢â‚¬Â ÃƒÂ¢Ã¢â€šÂ¬Ã¢â€žÂ¢ÃƒÆ’Ã†â€™ÃƒÂ¢Ã¢â€šÂ¬Ã‚Â ÃƒÆ’Ã‚Â¢ÃƒÂ¢Ã¢â‚¬Å¡Ã‚Â¬ÃƒÂ¢Ã¢â‚¬Å¾Ã‚Â¢ÃƒÆ’Ã†â€™Ãƒâ€ Ã¢â‚¬â„¢ÃƒÆ’Ã‚Â¢ÃƒÂ¢Ã¢â‚¬Å¡Ã‚Â¬Ãƒâ€šÃ‚Â ÃƒÆ’Ã†â€™Ãƒâ€šÃ‚Â¢ÃƒÆ’Ã‚Â¢ÃƒÂ¢Ã¢â€šÂ¬Ã…Â¡Ãƒâ€šÃ‚Â¬ÃƒÆ’Ã‚Â¢ÃƒÂ¢Ã¢â€šÂ¬Ã…Â¾Ãƒâ€šÃ‚Â¢ÃƒÆ’Ã†â€™Ãƒâ€ Ã¢â‚¬â„¢ÃƒÆ’Ã¢â‚¬Â ÃƒÂ¢Ã¢â€šÂ¬Ã¢â€žÂ¢ÃƒÆ’Ã†â€™Ãƒâ€šÃ‚Â¢ÃƒÆ’Ã‚Â¢ÃƒÂ¢Ã¢â€šÂ¬Ã…Â¡Ãƒâ€šÃ‚Â¬ÃƒÆ’Ã¢â‚¬Â¦Ãƒâ€šÃ‚Â¡ÃƒÆ’Ã†â€™Ãƒâ€ Ã¢â‚¬â„¢ÃƒÆ’Ã‚Â¢ÃƒÂ¢Ã¢â‚¬Å¡Ã‚Â¬Ãƒâ€¦Ã‚Â¡ÃƒÆ’Ã†â€™ÃƒÂ¢Ã¢â€šÂ¬Ã…Â¡ÃƒÆ’Ã¢â‚¬Å¡Ãƒâ€šÃ‚Â¢ÃƒÆ’Ã†â€™Ãƒâ€ Ã¢â‚¬â„¢ÃƒÆ’Ã¢â‚¬Â ÃƒÂ¢Ã¢â€šÂ¬Ã¢â€žÂ¢ÃƒÆ’Ã†â€™ÃƒÂ¢Ã¢â€šÂ¬Ã‚Â ÃƒÆ’Ã‚Â¢ÃƒÂ¢Ã¢â‚¬Å¡Ã‚Â¬ÃƒÂ¢Ã¢â‚¬Å¾Ã‚Â¢ÃƒÆ’Ã†â€™Ãƒâ€ Ã¢â‚¬â„¢ÃƒÆ’Ã‚Â¢ÃƒÂ¢Ã¢â‚¬Å¡Ã‚Â¬Ãƒâ€¦Ã‚Â¡ÃƒÆ’Ã†â€™ÃƒÂ¢Ã¢â€šÂ¬Ã…Â¡ÃƒÆ’Ã¢â‚¬Å¡Ãƒâ€šÃ‚Â¢ÃƒÆ’Ã†â€™Ãƒâ€ Ã¢â‚¬â„¢ÃƒÆ’Ã¢â‚¬Â ÃƒÂ¢Ã¢â€šÂ¬Ã¢â€žÂ¢ÃƒÆ’Ã†â€™ÃƒÂ¢Ã¢â€šÂ¬Ã…Â¡ÃƒÆ’Ã¢â‚¬Å¡Ãƒâ€šÃ‚Â¢ÃƒÆ’Ã†â€™Ãƒâ€ Ã¢â‚¬â„¢ÃƒÆ’Ã¢â‚¬Å¡Ãƒâ€šÃ‚Â¢ÃƒÆ’Ã†â€™Ãƒâ€šÃ‚Â¢ÃƒÆ’Ã‚Â¢ÃƒÂ¢Ã¢â€šÂ¬Ã…Â¡Ãƒâ€šÃ‚Â¬ÃƒÆ’Ã¢â‚¬Â¦Ãƒâ€šÃ‚Â¡ÃƒÆ’Ã†â€™ÃƒÂ¢Ã¢â€šÂ¬Ã…Â¡ÃƒÆ’Ã¢â‚¬Å¡Ãƒâ€šÃ‚Â¬ÃƒÆ’Ã†â€™Ãƒâ€ Ã¢â‚¬â„¢ÃƒÆ’Ã‚Â¢ÃƒÂ¢Ã¢â‚¬Å¡Ã‚Â¬Ãƒâ€šÃ‚Â¦ÃƒÆ’Ã†â€™ÃƒÂ¢Ã¢â€šÂ¬Ã…Â¡ÃƒÆ’Ã¢â‚¬Å¡Ãƒâ€šÃ‚Â¡ÃƒÆ’Ã†â€™Ãƒâ€ Ã¢â‚¬â„¢ÃƒÆ’Ã¢â‚¬Â ÃƒÂ¢Ã¢â€šÂ¬Ã¢â€žÂ¢ÃƒÆ’Ã†â€™Ãƒâ€šÃ‚Â¢ÃƒÆ’Ã‚Â¢ÃƒÂ¢Ã¢â€šÂ¬Ã…Â¡Ãƒâ€šÃ‚Â¬ÃƒÆ’Ã¢â‚¬Â¦Ãƒâ€šÃ‚Â¡ÃƒÆ’Ã†â€™Ãƒâ€ Ã¢â‚¬â„¢ÃƒÆ’Ã‚Â¢ÃƒÂ¢Ã¢â‚¬Å¡Ã‚Â¬Ãƒâ€¦Ã‚Â¡ÃƒÆ’Ã†â€™ÃƒÂ¢Ã¢â€šÂ¬Ã…Â¡ÃƒÆ’Ã¢â‚¬Å¡Ãƒâ€šÃ‚Â¬ÃƒÆ’Ã†â€™Ãƒâ€ Ã¢â‚¬â„¢ÃƒÆ’Ã¢â‚¬Â ÃƒÂ¢Ã¢â€šÂ¬Ã¢â€žÂ¢ÃƒÆ’Ã†â€™ÃƒÂ¢Ã¢â€šÂ¬Ã‚Â ÃƒÆ’Ã‚Â¢ÃƒÂ¢Ã¢â‚¬Å¡Ã‚Â¬ÃƒÂ¢Ã¢â‚¬Å¾Ã‚Â¢ÃƒÆ’Ã†â€™Ãƒâ€ Ã¢â‚¬â„¢ÃƒÆ’Ã¢â‚¬Å¡Ãƒâ€šÃ‚Â¢ÃƒÆ’Ã†â€™Ãƒâ€šÃ‚Â¢ÃƒÆ’Ã‚Â¢ÃƒÂ¢Ã¢â‚¬Å¡Ã‚Â¬Ãƒâ€¦Ã‚Â¡ÃƒÆ’Ã¢â‚¬Å¡Ãƒâ€šÃ‚Â¬ÃƒÆ’Ã†â€™ÃƒÂ¢Ã¢â€šÂ¬Ã…Â¡ÃƒÆ’Ã¢â‚¬Å¡Ãƒâ€šÃ‚Â¦ÃƒÆ’Ã†â€™Ãƒâ€ Ã¢â‚¬â„¢ÃƒÆ’Ã¢â‚¬Â ÃƒÂ¢Ã¢â€šÂ¬Ã¢â€žÂ¢ÃƒÆ’Ã†â€™ÃƒÂ¢Ã¢â€šÂ¬Ã…Â¡ÃƒÆ’Ã¢â‚¬Å¡Ãƒâ€šÃ‚Â¢ÃƒÆ’Ã†â€™Ãƒâ€ Ã¢â‚¬â„¢ÃƒÆ’Ã¢â‚¬Å¡Ãƒâ€šÃ‚Â¢ÃƒÆ’Ã†â€™Ãƒâ€šÃ‚Â¢ÃƒÆ’Ã‚Â¢ÃƒÂ¢Ã¢â€šÂ¬Ã…Â¡Ãƒâ€šÃ‚Â¬ÃƒÆ’Ã¢â‚¬Â¦Ãƒâ€šÃ‚Â¡ÃƒÆ’Ã†â€™ÃƒÂ¢Ã¢â€šÂ¬Ã…Â¡ÃƒÆ’Ã¢â‚¬Å¡Ãƒâ€šÃ‚Â¬ÃƒÆ’Ã†â€™Ãƒâ€ Ã¢â‚¬â„¢ÃƒÆ’Ã‚Â¢ÃƒÂ¢Ã¢â‚¬Å¡Ã‚Â¬Ãƒâ€šÃ‚Â¦ÃƒÆ’Ã†â€™Ãƒâ€šÃ‚Â¢ÃƒÆ’Ã‚Â¢ÃƒÂ¢Ã¢â€šÂ¬Ã…Â¡Ãƒâ€šÃ‚Â¬ÃƒÆ’Ã¢â‚¬Â¦ÃƒÂ¢Ã¢â€šÂ¬Ã…â€œ3), salinity increased in both systems; however, the Monoculture treatment consistently showed higher values (around 23.5 ppt) compared to the IMTA system (approximately 22.9 ppt).</w:t>
+      </w:r>
+    </w:p>
+    <w:p>
+      <w:pPr>
+        <w:spacing w:line="360" w:lineRule="auto"/>
+        <w:rPr>
+          <w:rFonts w:ascii="Times New Roman" w:hAnsi="Times New Roman" w:cs="Times New Roman"/>
+        </w:rPr>
+      </w:pPr>
+      <w:r>
+        <w:rPr>
+          <w:rFonts w:ascii="Times New Roman" w:hAnsi="Times New Roman" w:cs="Times New Roman"/>
+        </w:rPr>
+        <w:t xml:space="preserve">In the mid-phase of the study (Weeks 4ÃƒÆ’Ã†â€™Ãƒâ€ Ã¢â‚¬â„¢ÃƒÆ’Ã¢â‚¬Â ÃƒÂ¢Ã¢â€šÂ¬Ã¢â€žÂ¢ÃƒÆ’Ã†â€™ÃƒÂ¢Ã¢â€šÂ¬Ã‚Â ÃƒÆ’Ã‚Â¢ÃƒÂ¢Ã¢â‚¬Å¡Ã‚Â¬ÃƒÂ¢Ã¢â‚¬Å¾Ã‚Â¢ÃƒÆ’Ã†â€™Ãƒâ€ Ã¢â‚¬â„¢ÃƒÆ’Ã‚Â¢ÃƒÂ¢Ã¢â‚¬Å¡Ã‚Â¬Ãƒâ€šÃ‚Â ÃƒÆ’Ã†â€™Ãƒâ€šÃ‚Â¢ÃƒÆ’Ã‚Â¢ÃƒÂ¢Ã¢â€šÂ¬Ã…Â¡Ãƒâ€šÃ‚Â¬ÃƒÆ’Ã‚Â¢ÃƒÂ¢Ã¢â€šÂ¬Ã…Â¾Ãƒâ€šÃ‚Â¢ÃƒÆ’Ã†â€™Ãƒâ€ Ã¢â‚¬â„¢ÃƒÆ’Ã¢â‚¬Â ÃƒÂ¢Ã¢â€šÂ¬Ã¢â€žÂ¢ÃƒÆ’Ã†â€™Ãƒâ€šÃ‚Â¢ÃƒÆ’Ã‚Â¢ÃƒÂ¢Ã¢â€šÂ¬Ã…Â¡Ãƒâ€šÃ‚Â¬ÃƒÆ’Ã¢â‚¬Å¡Ãƒâ€šÃ‚Â ÃƒÆ’Ã†â€™Ãƒâ€ Ã¢â‚¬â„¢ÃƒÆ’Ã¢â‚¬Å¡Ãƒâ€šÃ‚Â¢ÃƒÆ’Ã†â€™Ãƒâ€šÃ‚Â¢ÃƒÆ’Ã‚Â¢ÃƒÂ¢Ã¢â‚¬Å¡Ã‚Â¬Ãƒâ€¦Ã‚Â¡ÃƒÆ’Ã¢â‚¬Å¡Ãƒâ€šÃ‚Â¬ÃƒÆ’Ã†â€™Ãƒâ€šÃ‚Â¢ÃƒÆ’Ã‚Â¢ÃƒÂ¢Ã¢â‚¬Å¡Ã‚Â¬Ãƒâ€¦Ã‚Â¾ÃƒÆ’Ã¢â‚¬Å¡Ãƒâ€šÃ‚Â¢ÃƒÆ’Ã†â€™Ãƒâ€ Ã¢â‚¬â„¢ÃƒÆ’Ã¢â‚¬Â ÃƒÂ¢Ã¢â€šÂ¬Ã¢â€žÂ¢ÃƒÆ’Ã†â€™ÃƒÂ¢Ã¢â€šÂ¬Ã‚Â ÃƒÆ’Ã‚Â¢ÃƒÂ¢Ã¢â‚¬Å¡Ã‚Â¬ÃƒÂ¢Ã¢â‚¬Å¾Ã‚Â¢ÃƒÆ’Ã†â€™Ãƒâ€ Ã¢â‚¬â„¢ÃƒÆ’Ã¢â‚¬Å¡Ãƒâ€šÃ‚Â¢ÃƒÆ’Ã†â€™Ãƒâ€šÃ‚Â¢ÃƒÆ’Ã‚Â¢ÃƒÂ¢Ã¢â‚¬Å¡Ã‚Â¬Ãƒâ€¦Ã‚Â¡ÃƒÆ’Ã¢â‚¬Å¡Ãƒâ€šÃ‚Â¬ÃƒÆ’Ã†â€™ÃƒÂ¢Ã¢â€šÂ¬Ã‚Â¦ÃƒÆ’Ã¢â‚¬Å¡Ãƒâ€šÃ‚Â¡ÃƒÆ’Ã†â€™Ãƒâ€ Ã¢â‚¬â„¢ÃƒÆ’Ã¢â‚¬Â ÃƒÂ¢Ã¢â€šÂ¬Ã¢â€žÂ¢ÃƒÆ’Ã†â€™Ãƒâ€šÃ‚Â¢ÃƒÆ’Ã‚Â¢ÃƒÂ¢Ã¢â€šÂ¬Ã…Â¡Ãƒâ€šÃ‚Â¬ÃƒÆ’Ã¢â‚¬Â¦Ãƒâ€šÃ‚Â¡ÃƒÆ’Ã†â€™Ãƒâ€ Ã¢â‚¬â„¢ÃƒÆ’Ã‚Â¢ÃƒÂ¢Ã¢â‚¬Å¡Ã‚Â¬Ãƒâ€¦Ã‚Â¡ÃƒÆ’Ã†â€™ÃƒÂ¢Ã¢â€šÂ¬Ã…Â¡ÃƒÆ’Ã¢â‚¬Å¡Ãƒâ€šÃ‚Â¢ÃƒÆ’Ã†â€™Ãƒâ€ Ã¢â‚¬â„¢ÃƒÆ’Ã¢â‚¬Â ÃƒÂ¢Ã¢â€šÂ¬Ã¢â€žÂ¢ÃƒÆ’Ã†â€™ÃƒÂ¢Ã¢â€šÂ¬Ã‚Â ÃƒÆ’Ã‚Â¢ÃƒÂ¢Ã¢â‚¬Å¡Ã‚Â¬ÃƒÂ¢Ã¢â‚¬Å¾Ã‚Â¢ÃƒÆ’Ã†â€™Ãƒâ€ Ã¢â‚¬â„¢ÃƒÆ’Ã‚Â¢ÃƒÂ¢Ã¢â‚¬Å¡Ã‚Â¬Ãƒâ€šÃ‚Â ÃƒÆ’Ã†â€™Ãƒâ€šÃ‚Â¢ÃƒÆ’Ã‚Â¢ÃƒÂ¢Ã¢â€šÂ¬Ã…Â¡Ãƒâ€šÃ‚Â¬ÃƒÆ’Ã‚Â¢ÃƒÂ¢Ã¢â€šÂ¬Ã…Â¾Ãƒâ€šÃ‚Â¢ÃƒÆ’Ã†â€™Ãƒâ€ Ã¢â‚¬â„¢ÃƒÆ’Ã¢â‚¬Â ÃƒÂ¢Ã¢â€šÂ¬Ã¢â€žÂ¢ÃƒÆ’Ã†â€™Ãƒâ€šÃ‚Â¢ÃƒÆ’Ã‚Â¢ÃƒÂ¢Ã¢â€šÂ¬Ã…Â¡Ãƒâ€šÃ‚Â¬ÃƒÆ’Ã¢â‚¬Â¦Ãƒâ€šÃ‚Â¡ÃƒÆ’Ã†â€™Ãƒâ€ Ã¢â‚¬â„¢ÃƒÆ’Ã‚Â¢ÃƒÂ¢Ã¢â‚¬Å¡Ã‚Â¬Ãƒâ€¦Ã‚Â¡ÃƒÆ’Ã†â€™ÃƒÂ¢Ã¢â€šÂ¬Ã…Â¡ÃƒÆ’Ã¢â‚¬Å¡Ãƒâ€šÃ‚Â¢ÃƒÆ’Ã†â€™Ãƒâ€ Ã¢â‚¬â„¢ÃƒÆ’Ã¢â‚¬Â ÃƒÂ¢Ã¢â€šÂ¬Ã¢â€žÂ¢ÃƒÆ’Ã†â€™ÃƒÂ¢Ã¢â€šÂ¬Ã‚Â ÃƒÆ’Ã‚Â¢ÃƒÂ¢Ã¢â‚¬Å¡Ã‚Â¬ÃƒÂ¢Ã¢â‚¬Å¾Ã‚Â¢ÃƒÆ’Ã†â€™Ãƒâ€ Ã¢â‚¬â„¢ÃƒÆ’Ã‚Â¢ÃƒÂ¢Ã¢â‚¬Å¡Ã‚Â¬Ãƒâ€¦Ã‚Â¡ÃƒÆ’Ã†â€™ÃƒÂ¢Ã¢â€šÂ¬Ã…Â¡ÃƒÆ’Ã¢â‚¬Å¡Ãƒâ€šÃ‚Â¢ÃƒÆ’Ã†â€™Ãƒâ€ Ã¢â‚¬â„¢ÃƒÆ’Ã¢â‚¬Â ÃƒÂ¢Ã¢â€šÂ¬Ã¢â€žÂ¢ÃƒÆ’Ã†â€™ÃƒÂ¢Ã¢â€šÂ¬Ã…Â¡ÃƒÆ’Ã¢â‚¬Å¡Ãƒâ€šÃ‚Â¢ÃƒÆ’Ã†â€™Ãƒâ€ Ã¢â‚¬â„¢ÃƒÆ’Ã¢â‚¬Å¡Ãƒâ€šÃ‚Â¢ÃƒÆ’Ã†â€™Ãƒâ€šÃ‚Â¢ÃƒÆ’Ã‚Â¢ÃƒÂ¢Ã¢â‚¬Å¡Ã‚Â¬Ãƒâ€¦Ã‚Â¡ÃƒÆ’Ã¢â‚¬Å¡Ãƒâ€šÃ‚Â¬ÃƒÆ’Ã†â€™ÃƒÂ¢Ã¢â€šÂ¬Ã‚Â¦ÃƒÆ’Ã¢â‚¬Å¡Ãƒâ€šÃ‚Â¡ÃƒÆ’Ã†â€™Ãƒâ€ Ã¢â‚¬â„¢ÃƒÆ’Ã‚Â¢ÃƒÂ¢Ã¢â‚¬Å¡Ã‚Â¬Ãƒâ€¦Ã‚Â¡ÃƒÆ’Ã†â€™ÃƒÂ¢Ã¢â€šÂ¬Ã…Â¡ÃƒÆ’Ã¢â‚¬Å¡Ãƒâ€šÃ‚Â¬ÃƒÆ’Ã†â€™Ãƒâ€ Ã¢â‚¬â„¢ÃƒÆ’Ã¢â‚¬Â ÃƒÂ¢Ã¢â€šÂ¬Ã¢â€žÂ¢ÃƒÆ’Ã†â€™Ãƒâ€šÃ‚Â¢ÃƒÆ’Ã‚Â¢ÃƒÂ¢Ã¢â€šÂ¬Ã…Â¡Ãƒâ€šÃ‚Â¬ÃƒÆ’Ã¢â‚¬Å¡Ãƒâ€šÃ‚Â¦ÃƒÆ’Ã†â€™Ãƒâ€ Ã¢â‚¬â„¢ÃƒÆ’Ã‚Â¢ÃƒÂ¢Ã¢â‚¬Å¡Ã‚Â¬Ãƒâ€¦Ã‚Â¡ÃƒÆ’Ã†â€™ÃƒÂ¢Ã¢â€šÂ¬Ã…Â¡ÃƒÆ’Ã¢â‚¬Å¡Ãƒâ€šÃ‚Â¡ÃƒÆ’Ã†â€™Ãƒâ€ Ã¢â‚¬â„¢ÃƒÆ’Ã¢â‚¬Â ÃƒÂ¢Ã¢â€šÂ¬Ã¢â€žÂ¢ÃƒÆ’Ã†â€™ÃƒÂ¢Ã¢â€šÂ¬Ã‚Â ÃƒÆ’Ã‚Â¢ÃƒÂ¢Ã¢â‚¬Å¡Ã‚Â¬ÃƒÂ¢Ã¢â‚¬Å¾Ã‚Â¢ÃƒÆ’Ã†â€™Ãƒâ€ Ã¢â‚¬â„¢ÃƒÆ’Ã¢â‚¬Å¡Ãƒâ€šÃ‚Â¢ÃƒÆ’Ã†â€™Ãƒâ€šÃ‚Â¢ÃƒÆ’Ã‚Â¢ÃƒÂ¢Ã¢â‚¬Å¡Ã‚Â¬Ãƒâ€¦Ã‚Â¡ÃƒÆ’Ã¢â‚¬Å¡Ãƒâ€šÃ‚Â¬ÃƒÆ’Ã†â€™ÃƒÂ¢Ã¢â€šÂ¬Ã‚Â¦ÃƒÆ’Ã¢â‚¬Å¡Ãƒâ€šÃ‚Â¡ÃƒÆ’Ã†â€™Ãƒâ€ Ã¢â‚¬â„¢ÃƒÆ’Ã¢â‚¬Â ÃƒÂ¢Ã¢â€šÂ¬Ã¢â€žÂ¢ÃƒÆ’Ã†â€™Ãƒâ€šÃ‚Â¢ÃƒÆ’Ã‚Â¢ÃƒÂ¢Ã¢â€šÂ¬Ã…Â¡Ãƒâ€šÃ‚Â¬ÃƒÆ’Ã¢â‚¬Â¦Ãƒâ€šÃ‚Â¡ÃƒÆ’Ã†â€™Ãƒâ€ Ã¢â‚¬â„¢ÃƒÆ’Ã‚Â¢ÃƒÂ¢Ã¢â‚¬Å¡Ã‚Â¬Ãƒâ€¦Ã‚Â¡ÃƒÆ’Ã†â€™ÃƒÂ¢Ã¢â€šÂ¬Ã…Â¡ÃƒÆ’Ã¢â‚¬Å¡Ãƒâ€šÃ‚Â¬ÃƒÆ’Ã†â€™Ãƒâ€ Ã¢â‚¬â„¢ÃƒÆ’Ã¢â‚¬Â ÃƒÂ¢Ã¢â€šÂ¬Ã¢â€žÂ¢ÃƒÆ’Ã†â€™ÃƒÂ¢Ã¢â€šÂ¬Ã‚Â ÃƒÆ’Ã‚Â¢ÃƒÂ¢Ã¢â‚¬Å¡Ã‚Â¬ÃƒÂ¢Ã¢â‚¬Å¾Ã‚Â¢ÃƒÆ’Ã†â€™Ãƒâ€ Ã¢â‚¬â„¢ÃƒÆ’Ã‚Â¢ÃƒÂ¢Ã¢â‚¬Å¡Ã‚Â¬Ãƒâ€šÃ‚Â ÃƒÆ’Ã†â€™Ãƒâ€šÃ‚Â¢ÃƒÆ’Ã‚Â¢ÃƒÂ¢Ã¢â€šÂ¬Ã…Â¡Ãƒâ€šÃ‚Â¬ÃƒÆ’Ã‚Â¢ÃƒÂ¢Ã¢â€šÂ¬Ã…Â¾Ãƒâ€šÃ‚Â¢ÃƒÆ’Ã†â€™Ãƒâ€ Ã¢â‚¬â„¢ÃƒÆ’Ã¢â‚¬Â ÃƒÂ¢Ã¢â€šÂ¬Ã¢â€žÂ¢ÃƒÆ’Ã†â€™Ãƒâ€šÃ‚Â¢ÃƒÆ’Ã‚Â¢ÃƒÂ¢Ã¢â€šÂ¬Ã…Â¡Ãƒâ€šÃ‚Â¬ÃƒÆ’Ã¢â‚¬Â¦Ãƒâ€šÃ‚Â¡ÃƒÆ’Ã†â€™Ãƒâ€ Ã¢â‚¬â„¢ÃƒÆ’Ã‚Â¢ÃƒÂ¢Ã¢â‚¬Å¡Ã‚Â¬Ãƒâ€¦Ã‚Â¡ÃƒÆ’Ã†â€™ÃƒÂ¢Ã¢â€šÂ¬Ã…Â¡ÃƒÆ’Ã¢â‚¬Å¡Ãƒâ€šÃ‚Â¢ÃƒÆ’Ã†â€™Ãƒâ€ Ã¢â‚¬â„¢ÃƒÆ’Ã¢â‚¬Â ÃƒÂ¢Ã¢â€šÂ¬Ã¢â€žÂ¢ÃƒÆ’Ã†â€™ÃƒÂ¢Ã¢â€šÂ¬Ã‚Â ÃƒÆ’Ã‚Â¢ÃƒÂ¢Ã¢â‚¬Å¡Ã‚Â¬ÃƒÂ¢Ã¢â‚¬Å¾Ã‚Â¢ÃƒÆ’Ã†â€™Ãƒâ€ Ã¢â‚¬â„¢ÃƒÆ’Ã‚Â¢ÃƒÂ¢Ã¢â‚¬Å¡Ã‚Â¬Ãƒâ€¦Ã‚Â¡ÃƒÆ’Ã†â€™ÃƒÂ¢Ã¢â€šÂ¬Ã…Â¡ÃƒÆ’Ã¢â‚¬Å¡Ãƒâ€šÃ‚Â¢ÃƒÆ’Ã†â€™Ãƒâ€ Ã¢â‚¬â„¢ÃƒÆ’Ã¢â‚¬Â ÃƒÂ¢Ã¢â€šÂ¬Ã¢â€žÂ¢ÃƒÆ’Ã†â€™ÃƒÂ¢Ã¢â€šÂ¬Ã…Â¡ÃƒÆ’Ã¢â‚¬Å¡Ãƒâ€šÃ‚Â¢ÃƒÆ’Ã†â€™Ãƒâ€ Ã¢â‚¬â„¢ÃƒÆ’Ã¢â‚¬Å¡Ãƒâ€šÃ‚Â¢ÃƒÆ’Ã†â€™Ãƒâ€šÃ‚Â¢ÃƒÆ’Ã‚Â¢ÃƒÂ¢Ã¢â€šÂ¬Ã…Â¡Ãƒâ€šÃ‚Â¬ÃƒÆ’Ã¢â‚¬Â¦Ãƒâ€šÃ‚Â¡ÃƒÆ’Ã†â€™ÃƒÂ¢Ã¢â€šÂ¬Ã…Â¡ÃƒÆ’Ã¢â‚¬Å¡Ãƒâ€šÃ‚Â¬ÃƒÆ’Ã†â€™Ãƒâ€ Ã¢â‚¬â„¢ÃƒÆ’Ã‚Â¢ÃƒÂ¢Ã¢â‚¬Å¡Ã‚Â¬Ãƒâ€šÃ‚Â¦ÃƒÆ’Ã†â€™ÃƒÂ¢Ã¢â€šÂ¬Ã…Â¡ÃƒÆ’Ã¢â‚¬Å¡Ãƒâ€šÃ‚Â¡ÃƒÆ’Ã†â€™Ãƒâ€ Ã¢â‚¬â„¢ÃƒÆ’Ã¢â‚¬Â ÃƒÂ¢Ã¢â€šÂ¬Ã¢â€žÂ¢ÃƒÆ’Ã†â€™Ãƒâ€šÃ‚Â¢ÃƒÆ’Ã‚Â¢ÃƒÂ¢Ã¢â€šÂ¬Ã…Â¡Ãƒâ€šÃ‚Â¬ÃƒÆ’Ã¢â‚¬Â¦Ãƒâ€šÃ‚Â¡ÃƒÆ’Ã†â€™Ãƒâ€ Ã¢â‚¬â„¢ÃƒÆ’Ã‚Â¢ÃƒÂ¢Ã¢â‚¬Å¡Ã‚Â¬Ãƒâ€¦Ã‚Â¡ÃƒÆ’Ã†â€™ÃƒÂ¢Ã¢â€šÂ¬Ã…Â¡ÃƒÆ’Ã¢â‚¬Å¡Ãƒâ€šÃ‚Â¬ÃƒÆ’Ã†â€™Ãƒâ€ Ã¢â‚¬â„¢ÃƒÆ’Ã¢â‚¬Â ÃƒÂ¢Ã¢â€šÂ¬Ã¢â€žÂ¢ÃƒÆ’Ã†â€™ÃƒÂ¢Ã¢â€šÂ¬Ã‚Â ÃƒÆ’Ã‚Â¢ÃƒÂ¢Ã¢â‚¬Å¡Ã‚Â¬ÃƒÂ¢Ã¢â‚¬Å¾Ã‚Â¢ÃƒÆ’Ã†â€™Ãƒâ€ Ã¢â‚¬â„¢ÃƒÆ’Ã¢â‚¬Å¡Ãƒâ€šÃ‚Â¢ÃƒÆ’Ã†â€™Ãƒâ€šÃ‚Â¢ÃƒÆ’Ã‚Â¢ÃƒÂ¢Ã¢â‚¬Å¡Ã‚Â¬Ãƒâ€¦Ã‚Â¡ÃƒÆ’Ã¢â‚¬Å¡Ãƒâ€šÃ‚Â¬ÃƒÆ’Ã†â€™ÃƒÂ¢Ã¢â€šÂ¬Ã…Â¡ÃƒÆ’Ã¢â‚¬Å¡Ãƒâ€šÃ‚Â¦ÃƒÆ’Ã†â€™Ãƒâ€ Ã¢â‚¬â„¢ÃƒÆ’Ã¢â‚¬Â ÃƒÂ¢Ã¢â€šÂ¬Ã¢â€žÂ¢ÃƒÆ’Ã†â€™ÃƒÂ¢Ã¢â€šÂ¬Ã…Â¡ÃƒÆ’Ã¢â‚¬Å¡Ãƒâ€šÃ‚Â¢ÃƒÆ’Ã†â€™Ãƒâ€ Ã¢â‚¬â„¢ÃƒÆ’Ã¢â‚¬Å¡Ãƒâ€šÃ‚Â¢ÃƒÆ’Ã†â€™Ãƒâ€šÃ‚Â¢ÃƒÆ’Ã‚Â¢ÃƒÂ¢Ã¢â€šÂ¬Ã…Â¡Ãƒâ€šÃ‚Â¬ÃƒÆ’Ã¢â‚¬Â¦Ãƒâ€šÃ‚Â¡ÃƒÆ’Ã†â€™ÃƒÂ¢Ã¢â€šÂ¬Ã…Â¡ÃƒÆ’Ã¢â‚¬Å¡Ãƒâ€šÃ‚Â¬ÃƒÆ’Ã†â€™Ãƒâ€ Ã¢â‚¬â„¢ÃƒÆ’Ã‚Â¢ÃƒÂ¢Ã¢â‚¬Å¡Ã‚Â¬Ãƒâ€šÃ‚Â¦ÃƒÆ’Ã†â€™Ãƒâ€šÃ‚Â¢ÃƒÆ’Ã‚Â¢ÃƒÂ¢Ã¢â€šÂ¬Ã…Â¡Ãƒâ€šÃ‚Â¬ÃƒÆ’Ã¢â‚¬Â¦ÃƒÂ¢Ã¢â€šÂ¬Ã…â€œ5), the salinity levels of both treatments briefly converged at about 21.5 ppt in Week 4. This was followed by a notable divergence in Week 5, where Monoculture salinity increased sharply to approximately 24.0 ppt, while the IMTA system </w:t>
       </w:r>
       <w:r>
         <w:rPr>
@@ -6923,7 +6923,7 @@
         <w:rPr>
           <w:rFonts w:ascii="Times New Roman" w:hAnsi="Times New Roman" w:cs="Times New Roman"/>
         </w:rPr>
-        <w:t>The line graph illustrates the weekly variation in water temperature (ÃƒÆ’Ã†â€™Ãƒâ€ Ã¢â‚¬â„¢ÃƒÆ’Ã¢â‚¬Â ÃƒÂ¢Ã¢â€šÂ¬Ã¢â€žÂ¢ÃƒÆ’Ã†â€™ÃƒÂ¢Ã¢â€šÂ¬Ã‚Â ÃƒÆ’Ã‚Â¢ÃƒÂ¢Ã¢â‚¬Å¡Ã‚Â¬ÃƒÂ¢Ã¢â‚¬Å¾Ã‚Â¢ÃƒÆ’Ã†â€™Ãƒâ€ Ã¢â‚¬â„¢ÃƒÆ’Ã¢â‚¬Å¡Ãƒâ€šÃ‚Â¢ÃƒÆ’Ã†â€™Ãƒâ€šÃ‚Â¢ÃƒÆ’Ã‚Â¢ÃƒÂ¢Ã¢â‚¬Å¡Ã‚Â¬Ãƒâ€¦Ã‚Â¡ÃƒÆ’Ã¢â‚¬Å¡Ãƒâ€šÃ‚Â¬ÃƒÆ’Ã†â€™ÃƒÂ¢Ã¢â€šÂ¬Ã‚Â¦ÃƒÆ’Ã¢â‚¬Å¡Ãƒâ€šÃ‚Â¡ÃƒÆ’Ã†â€™Ãƒâ€ Ã¢â‚¬â„¢ÃƒÆ’Ã¢â‚¬Â ÃƒÂ¢Ã¢â€šÂ¬Ã¢â€žÂ¢ÃƒÆ’Ã†â€™Ãƒâ€šÃ‚Â¢ÃƒÆ’Ã‚Â¢ÃƒÂ¢Ã¢â€šÂ¬Ã…Â¡Ãƒâ€šÃ‚Â¬ÃƒÆ’Ã¢â‚¬Â¦Ãƒâ€šÃ‚Â¡ÃƒÆ’Ã†â€™Ãƒâ€ Ã¢â‚¬â„¢ÃƒÆ’Ã‚Â¢ÃƒÂ¢Ã¢â‚¬Å¡Ã‚Â¬Ãƒâ€¦Ã‚Â¡ÃƒÆ’Ã†â€™ÃƒÂ¢Ã¢â€šÂ¬Ã…Â¡ÃƒÆ’Ã¢â‚¬Å¡Ãƒâ€šÃ‚Â°C) in two aquaculture systems, Integrated Multi-Trophic Aquaculture (IMTA) and Monoculture, over a seven-week period. Overall, both treatments exhibited a very similar pattern of fluctuation throughout the study. At the beginning (Week 1), water temperature was relatively high in both systems, with Monoculture showing a slightly higher value (approximately 28.7ÃƒÆ’Ã†â€™Ãƒâ€ Ã¢â‚¬â„¢ÃƒÆ’Ã¢â‚¬Â ÃƒÂ¢Ã¢â€šÂ¬Ã¢â€žÂ¢ÃƒÆ’Ã†â€™ÃƒÂ¢Ã¢â€šÂ¬Ã‚Â ÃƒÆ’Ã‚Â¢ÃƒÂ¢Ã¢â‚¬Å¡Ã‚Â¬ÃƒÂ¢Ã¢â‚¬Å¾Ã‚Â¢ÃƒÆ’Ã†â€™Ãƒâ€ Ã¢â‚¬â„¢ÃƒÆ’Ã¢â‚¬Å¡Ãƒâ€šÃ‚Â¢ÃƒÆ’Ã†â€™Ãƒâ€šÃ‚Â¢ÃƒÆ’Ã‚Â¢ÃƒÂ¢Ã¢â‚¬Å¡Ã‚Â¬Ãƒâ€¦Ã‚Â¡ÃƒÆ’Ã¢â‚¬Å¡Ãƒâ€šÃ‚Â¬ÃƒÆ’Ã†â€™ÃƒÂ¢Ã¢â€šÂ¬Ã‚Â¦ÃƒÆ’Ã¢â‚¬Å¡Ãƒâ€šÃ‚Â¡ÃƒÆ’Ã†â€™Ãƒâ€ Ã¢â‚¬â„¢ÃƒÆ’Ã¢â‚¬Â ÃƒÂ¢Ã¢â€šÂ¬Ã¢â€žÂ¢ÃƒÆ’Ã†â€™Ãƒâ€šÃ‚Â¢ÃƒÆ’Ã‚Â¢ÃƒÂ¢Ã¢â€šÂ¬Ã…Â¡Ãƒâ€šÃ‚Â¬ÃƒÆ’Ã¢â‚¬Â¦Ãƒâ€šÃ‚Â¡ÃƒÆ’Ã†â€™Ãƒâ€ Ã¢â‚¬â„¢ÃƒÆ’Ã‚Â¢ÃƒÂ¢Ã¢â‚¬Å¡Ã‚Â¬Ãƒâ€¦Ã‚Â¡ÃƒÆ’Ã†â€™ÃƒÂ¢Ã¢â€šÂ¬Ã…Â¡ÃƒÆ’Ã¢â‚¬Å¡Ãƒâ€šÃ‚Â°C) compared to IMTA (around 28.2ÃƒÆ’Ã†â€™Ãƒâ€ Ã¢â‚¬â„¢ÃƒÆ’Ã¢â‚¬Â ÃƒÂ¢Ã¢â€šÂ¬Ã¢â€žÂ¢ÃƒÆ’Ã†â€™ÃƒÂ¢Ã¢â€šÂ¬Ã‚Â ÃƒÆ’Ã‚Â¢ÃƒÂ¢Ã¢â‚¬Å¡Ã‚Â¬ÃƒÂ¢Ã¢â‚¬Å¾Ã‚Â¢ÃƒÆ’Ã†â€™Ãƒâ€ Ã¢â‚¬â„¢ÃƒÆ’Ã¢â‚¬Å¡Ãƒâ€šÃ‚Â¢ÃƒÆ’Ã†â€™Ãƒâ€šÃ‚Â¢ÃƒÆ’Ã‚Â¢ÃƒÂ¢Ã¢â‚¬Å¡Ã‚Â¬Ãƒâ€¦Ã‚Â¡ÃƒÆ’Ã¢â‚¬Å¡Ãƒâ€šÃ‚Â¬ÃƒÆ’Ã†â€™ÃƒÂ¢Ã¢â€šÂ¬Ã‚Â¦ÃƒÆ’Ã¢â‚¬Å¡Ãƒâ€šÃ‚Â¡ÃƒÆ’Ã†â€™Ãƒâ€ Ã¢â‚¬â„¢ÃƒÆ’Ã¢â‚¬Â ÃƒÂ¢Ã¢â€šÂ¬Ã¢â€žÂ¢ÃƒÆ’Ã†â€™Ãƒâ€šÃ‚Â¢ÃƒÆ’Ã‚Â¢ÃƒÂ¢Ã¢â€šÂ¬Ã…Â¡Ãƒâ€šÃ‚Â¬ÃƒÆ’Ã¢â‚¬Â¦Ãƒâ€šÃ‚Â¡ÃƒÆ’Ã†â€™Ãƒâ€ Ã¢â‚¬â„¢ÃƒÆ’Ã‚Â¢ÃƒÂ¢Ã¢â‚¬Å¡Ã‚Â¬Ãƒâ€¦Ã‚Â¡ÃƒÆ’Ã†â€™ÃƒÂ¢Ã¢â€šÂ¬Ã…Â¡ÃƒÆ’Ã¢â‚¬Å¡Ãƒâ€šÃ‚Â°C). From Week 1 to Week 4, a clear declining trend was observed in both treatments, reaching the lowest temperatures at Week 4 (about 25.9ÃƒÆ’Ã†â€™Ãƒâ€ Ã¢â‚¬â„¢ÃƒÆ’Ã¢â‚¬Â ÃƒÂ¢Ã¢â€šÂ¬Ã¢â€žÂ¢ÃƒÆ’Ã†â€™ÃƒÂ¢Ã¢â€šÂ¬Ã‚Â ÃƒÆ’Ã‚Â¢ÃƒÂ¢Ã¢â‚¬Å¡Ã‚Â¬ÃƒÂ¢Ã¢â‚¬Å¾Ã‚Â¢ÃƒÆ’Ã†â€™Ãƒâ€ Ã¢â‚¬â„¢ÃƒÆ’Ã¢â‚¬Å¡Ãƒâ€šÃ‚Â¢ÃƒÆ’Ã†â€™Ãƒâ€šÃ‚Â¢ÃƒÆ’Ã‚Â¢ÃƒÂ¢Ã¢â‚¬Å¡Ã‚Â¬Ãƒâ€¦Ã‚Â¡ÃƒÆ’Ã¢â‚¬Å¡Ãƒâ€šÃ‚Â¬ÃƒÆ’Ã†â€™ÃƒÂ¢Ã¢â€šÂ¬Ã‚Â¦ÃƒÆ’Ã¢â‚¬Å¡Ãƒâ€šÃ‚Â¡ÃƒÆ’Ã†â€™Ãƒâ€ Ã¢â‚¬â„¢ÃƒÆ’Ã¢â‚¬Â ÃƒÂ¢Ã¢â€šÂ¬Ã¢â€žÂ¢ÃƒÆ’Ã†â€™Ãƒâ€šÃ‚Â¢ÃƒÆ’Ã‚Â¢ÃƒÂ¢Ã¢â€šÂ¬Ã…Â¡Ãƒâ€šÃ‚Â¬ÃƒÆ’Ã¢â‚¬Â¦Ãƒâ€šÃ‚Â¡ÃƒÆ’Ã†â€™Ãƒâ€ Ã¢â‚¬â„¢ÃƒÆ’Ã‚Â¢ÃƒÂ¢Ã¢â‚¬Å¡Ã‚Â¬Ãƒâ€¦Ã‚Â¡ÃƒÆ’Ã†â€™ÃƒÂ¢Ã¢â€šÂ¬Ã…Â¡ÃƒÆ’Ã¢â‚¬Å¡Ãƒâ€šÃ‚Â°C in Monoculture and 25.7ÃƒÆ’Ã†â€™Ãƒâ€ Ã¢â‚¬â„¢ÃƒÆ’Ã¢â‚¬Â ÃƒÂ¢Ã¢â€šÂ¬Ã¢â€žÂ¢ÃƒÆ’Ã†â€™ÃƒÂ¢Ã¢â€šÂ¬Ã‚Â ÃƒÆ’Ã‚Â¢ÃƒÂ¢Ã¢â‚¬Å¡Ã‚Â¬ÃƒÂ¢Ã¢â‚¬Å¾Ã‚Â¢ÃƒÆ’Ã†â€™Ãƒâ€ Ã¢â‚¬â„¢ÃƒÆ’Ã¢â‚¬Å¡Ãƒâ€šÃ‚Â¢ÃƒÆ’Ã†â€™Ãƒâ€šÃ‚Â¢ÃƒÆ’Ã‚Â¢ÃƒÂ¢Ã¢â‚¬Å¡Ã‚Â¬Ãƒâ€¦Ã‚Â¡ÃƒÆ’Ã¢â‚¬Å¡Ãƒâ€šÃ‚Â¬ÃƒÆ’Ã†â€™ÃƒÂ¢Ã¢â€šÂ¬Ã‚Â¦ÃƒÆ’Ã¢â‚¬Å¡Ãƒâ€šÃ‚Â¡ÃƒÆ’Ã†â€™Ãƒâ€ Ã¢â‚¬â„¢ÃƒÆ’Ã¢â‚¬Â ÃƒÂ¢Ã¢â€šÂ¬Ã¢â€žÂ¢ÃƒÆ’Ã†â€™Ãƒâ€šÃ‚Â¢ÃƒÆ’Ã‚Â¢ÃƒÂ¢Ã¢â€šÂ¬Ã…Â¡Ãƒâ€šÃ‚Â¬ÃƒÆ’Ã¢â‚¬Â¦Ãƒâ€šÃ‚Â¡ÃƒÆ’Ã†â€™Ãƒâ€ Ã¢â‚¬â„¢ÃƒÆ’Ã‚Â¢ÃƒÂ¢Ã¢â‚¬Å¡Ã‚Â¬Ãƒâ€¦Ã‚Â¡ÃƒÆ’Ã†â€™ÃƒÂ¢Ã¢â€šÂ¬Ã…Â¡ÃƒÆ’Ã¢â‚¬Å¡Ãƒâ€šÃ‚Â°C in IMTA). Following this decline, temperatures increased sharply in Week 5 and then remained relatively stable through Weeks 6 and 7 at approximately 28.1ÃƒÆ’Ã†â€™Ãƒâ€ Ã¢â‚¬â„¢ÃƒÆ’Ã¢â‚¬Â ÃƒÂ¢Ã¢â€šÂ¬Ã¢â€žÂ¢ÃƒÆ’Ã†â€™ÃƒÂ¢Ã¢â€šÂ¬Ã‚Â ÃƒÆ’Ã‚Â¢ÃƒÂ¢Ã¢â‚¬Å¡Ã‚Â¬ÃƒÂ¢Ã¢â‚¬Å¾Ã‚Â¢ÃƒÆ’Ã†â€™Ãƒâ€ Ã¢â‚¬â„¢ÃƒÆ’Ã¢â‚¬Å¡Ãƒâ€šÃ‚Â¢ÃƒÆ’Ã†â€™Ãƒâ€šÃ‚Â¢ÃƒÆ’Ã‚Â¢ÃƒÂ¢Ã¢â‚¬Å¡Ã‚Â¬Ãƒâ€¦Ã‚Â¡ÃƒÆ’Ã¢â‚¬Å¡Ãƒâ€šÃ‚Â¬ÃƒÆ’Ã†â€™ÃƒÂ¢Ã¢â€šÂ¬Ã‚Â¦ÃƒÆ’Ã¢â‚¬Å¡Ãƒâ€šÃ‚Â¡ÃƒÆ’Ã†â€™Ãƒâ€ Ã¢â‚¬â„¢ÃƒÆ’Ã¢â‚¬Â ÃƒÂ¢Ã¢â€šÂ¬Ã¢â€žÂ¢ÃƒÆ’Ã†â€™Ãƒâ€šÃ‚Â¢ÃƒÆ’Ã‚Â¢ÃƒÂ¢Ã¢â€šÂ¬Ã…Â¡Ãƒâ€šÃ‚Â¬ÃƒÆ’Ã¢â‚¬Â¦Ãƒâ€šÃ‚Â¡ÃƒÆ’Ã†â€™Ãƒâ€ Ã¢â‚¬â„¢ÃƒÆ’Ã‚Â¢ÃƒÂ¢Ã¢â‚¬Å¡Ã‚Â¬Ãƒâ€¦Ã‚Â¡ÃƒÆ’Ã†â€™ÃƒÂ¢Ã¢â€šÂ¬Ã…Â¡ÃƒÆ’Ã¢â‚¬Å¡Ãƒâ€šÃ‚Â°C in both systems.</w:t>
+        <w:t>The line graph illustrates the weekly variation in water temperature (ÃƒÆ’Ã†â€™Ãƒâ€ Ã¢â‚¬â„¢ÃƒÆ’Ã¢â‚¬Â ÃƒÂ¢Ã¢â€šÂ¬Ã¢â€žÂ¢ÃƒÆ’Ã†â€™ÃƒÂ¢Ã¢â€šÂ¬Ã‚Â ÃƒÆ’Ã‚Â¢ÃƒÂ¢Ã¢â‚¬Å¡Ã‚Â¬ÃƒÂ¢Ã¢â‚¬Å¾Ã‚Â¢ÃƒÆ’Ã†â€™Ãƒâ€ Ã¢â‚¬â„¢ÃƒÆ’Ã‚Â¢ÃƒÂ¢Ã¢â‚¬Å¡Ã‚Â¬Ãƒâ€šÃ‚Â ÃƒÆ’Ã†â€™Ãƒâ€šÃ‚Â¢ÃƒÆ’Ã‚Â¢ÃƒÂ¢Ã¢â€šÂ¬Ã…Â¡Ãƒâ€šÃ‚Â¬ÃƒÆ’Ã‚Â¢ÃƒÂ¢Ã¢â€šÂ¬Ã…Â¾Ãƒâ€šÃ‚Â¢ÃƒÆ’Ã†â€™Ãƒâ€ Ã¢â‚¬â„¢ÃƒÆ’Ã¢â‚¬Â ÃƒÂ¢Ã¢â€šÂ¬Ã¢â€žÂ¢ÃƒÆ’Ã†â€™Ãƒâ€šÃ‚Â¢ÃƒÆ’Ã‚Â¢ÃƒÂ¢Ã¢â€šÂ¬Ã…Â¡Ãƒâ€šÃ‚Â¬ÃƒÆ’Ã¢â‚¬Å¡Ãƒâ€šÃ‚Â ÃƒÆ’Ã†â€™Ãƒâ€ Ã¢â‚¬â„¢ÃƒÆ’Ã¢â‚¬Å¡Ãƒâ€šÃ‚Â¢ÃƒÆ’Ã†â€™Ãƒâ€šÃ‚Â¢ÃƒÆ’Ã‚Â¢ÃƒÂ¢Ã¢â‚¬Å¡Ã‚Â¬Ãƒâ€¦Ã‚Â¡ÃƒÆ’Ã¢â‚¬Å¡Ãƒâ€šÃ‚Â¬ÃƒÆ’Ã†â€™Ãƒâ€šÃ‚Â¢ÃƒÆ’Ã‚Â¢ÃƒÂ¢Ã¢â‚¬Å¡Ã‚Â¬Ãƒâ€¦Ã‚Â¾ÃƒÆ’Ã¢â‚¬Å¡Ãƒâ€šÃ‚Â¢ÃƒÆ’Ã†â€™Ãƒâ€ Ã¢â‚¬â„¢ÃƒÆ’Ã¢â‚¬Â ÃƒÂ¢Ã¢â€šÂ¬Ã¢â€žÂ¢ÃƒÆ’Ã†â€™ÃƒÂ¢Ã¢â€šÂ¬Ã‚Â ÃƒÆ’Ã‚Â¢ÃƒÂ¢Ã¢â‚¬Å¡Ã‚Â¬ÃƒÂ¢Ã¢â‚¬Å¾Ã‚Â¢ÃƒÆ’Ã†â€™Ãƒâ€ Ã¢â‚¬â„¢ÃƒÆ’Ã‚Â¢ÃƒÂ¢Ã¢â‚¬Å¡Ã‚Â¬Ãƒâ€¦Ã‚Â¡ÃƒÆ’Ã†â€™ÃƒÂ¢Ã¢â€šÂ¬Ã…Â¡ÃƒÆ’Ã¢â‚¬Å¡Ãƒâ€šÃ‚Â¢ÃƒÆ’Ã†â€™Ãƒâ€ Ã¢â‚¬â„¢ÃƒÆ’Ã¢â‚¬Â ÃƒÂ¢Ã¢â€šÂ¬Ã¢â€žÂ¢ÃƒÆ’Ã†â€™ÃƒÂ¢Ã¢â€šÂ¬Ã…Â¡ÃƒÆ’Ã¢â‚¬Å¡Ãƒâ€šÃ‚Â¢ÃƒÆ’Ã†â€™Ãƒâ€ Ã¢â‚¬â„¢ÃƒÆ’Ã¢â‚¬Å¡Ãƒâ€šÃ‚Â¢ÃƒÆ’Ã†â€™Ãƒâ€šÃ‚Â¢ÃƒÆ’Ã‚Â¢ÃƒÂ¢Ã¢â‚¬Å¡Ã‚Â¬Ãƒâ€¦Ã‚Â¡ÃƒÆ’Ã¢â‚¬Å¡Ãƒâ€šÃ‚Â¬ÃƒÆ’Ã†â€™ÃƒÂ¢Ã¢â€šÂ¬Ã‚Â¦ÃƒÆ’Ã¢â‚¬Å¡Ãƒâ€šÃ‚Â¡ÃƒÆ’Ã†â€™Ãƒâ€ Ã¢â‚¬â„¢ÃƒÆ’Ã‚Â¢ÃƒÂ¢Ã¢â‚¬Å¡Ã‚Â¬Ãƒâ€¦Ã‚Â¡ÃƒÆ’Ã†â€™ÃƒÂ¢Ã¢â€šÂ¬Ã…Â¡ÃƒÆ’Ã¢â‚¬Å¡Ãƒâ€šÃ‚Â¬ÃƒÆ’Ã†â€™Ãƒâ€ Ã¢â‚¬â„¢ÃƒÆ’Ã¢â‚¬Â ÃƒÂ¢Ã¢â€šÂ¬Ã¢â€žÂ¢ÃƒÆ’Ã†â€™Ãƒâ€šÃ‚Â¢ÃƒÆ’Ã‚Â¢ÃƒÂ¢Ã¢â€šÂ¬Ã…Â¡Ãƒâ€šÃ‚Â¬ÃƒÆ’Ã¢â‚¬Å¡Ãƒâ€šÃ‚Â¦ÃƒÆ’Ã†â€™Ãƒâ€ Ã¢â‚¬â„¢ÃƒÆ’Ã‚Â¢ÃƒÂ¢Ã¢â‚¬Å¡Ã‚Â¬Ãƒâ€¦Ã‚Â¡ÃƒÆ’Ã†â€™ÃƒÂ¢Ã¢â€šÂ¬Ã…Â¡ÃƒÆ’Ã¢â‚¬Å¡Ãƒâ€šÃ‚Â¡ÃƒÆ’Ã†â€™Ãƒâ€ Ã¢â‚¬â„¢ÃƒÆ’Ã¢â‚¬Â ÃƒÂ¢Ã¢â€šÂ¬Ã¢â€žÂ¢ÃƒÆ’Ã†â€™ÃƒÂ¢Ã¢â€šÂ¬Ã‚Â ÃƒÆ’Ã‚Â¢ÃƒÂ¢Ã¢â‚¬Å¡Ã‚Â¬ÃƒÂ¢Ã¢â‚¬Å¾Ã‚Â¢ÃƒÆ’Ã†â€™Ãƒâ€ Ã¢â‚¬â„¢ÃƒÆ’Ã‚Â¢ÃƒÂ¢Ã¢â‚¬Å¡Ã‚Â¬Ãƒâ€šÃ‚Â ÃƒÆ’Ã†â€™Ãƒâ€šÃ‚Â¢ÃƒÆ’Ã‚Â¢ÃƒÂ¢Ã¢â€šÂ¬Ã…Â¡Ãƒâ€šÃ‚Â¬ÃƒÆ’Ã‚Â¢ÃƒÂ¢Ã¢â€šÂ¬Ã…Â¾Ãƒâ€šÃ‚Â¢ÃƒÆ’Ã†â€™Ãƒâ€ Ã¢â‚¬â„¢ÃƒÆ’Ã¢â‚¬Â ÃƒÂ¢Ã¢â€šÂ¬Ã¢â€žÂ¢ÃƒÆ’Ã†â€™ÃƒÂ¢Ã¢â€šÂ¬Ã…Â¡ÃƒÆ’Ã¢â‚¬Å¡Ãƒâ€šÃ‚Â¢ÃƒÆ’Ã†â€™Ãƒâ€ Ã¢â‚¬â„¢ÃƒÆ’Ã¢â‚¬Å¡Ãƒâ€šÃ‚Â¢ÃƒÆ’Ã†â€™Ãƒâ€šÃ‚Â¢ÃƒÆ’Ã‚Â¢ÃƒÂ¢Ã¢â€šÂ¬Ã…Â¡Ãƒâ€šÃ‚Â¬ÃƒÆ’Ã¢â‚¬Â¦Ãƒâ€šÃ‚Â¡ÃƒÆ’Ã†â€™ÃƒÂ¢Ã¢â€šÂ¬Ã…Â¡ÃƒÆ’Ã¢â‚¬Å¡Ãƒâ€šÃ‚Â¬ÃƒÆ’Ã†â€™Ãƒâ€ Ã¢â‚¬â„¢ÃƒÆ’Ã‚Â¢ÃƒÂ¢Ã¢â‚¬Å¡Ã‚Â¬Ãƒâ€šÃ‚Â¦ÃƒÆ’Ã†â€™ÃƒÂ¢Ã¢â€šÂ¬Ã…Â¡ÃƒÆ’Ã¢â‚¬Å¡Ãƒâ€šÃ‚Â¡ÃƒÆ’Ã†â€™Ãƒâ€ Ã¢â‚¬â„¢ÃƒÆ’Ã¢â‚¬Â ÃƒÂ¢Ã¢â€šÂ¬Ã¢â€žÂ¢ÃƒÆ’Ã†â€™ÃƒÂ¢Ã¢â€šÂ¬Ã‚Â ÃƒÆ’Ã‚Â¢ÃƒÂ¢Ã¢â‚¬Å¡Ã‚Â¬ÃƒÂ¢Ã¢â‚¬Å¾Ã‚Â¢ÃƒÆ’Ã†â€™Ãƒâ€ Ã¢â‚¬â„¢ÃƒÆ’Ã¢â‚¬Å¡Ãƒâ€šÃ‚Â¢ÃƒÆ’Ã†â€™Ãƒâ€šÃ‚Â¢ÃƒÆ’Ã‚Â¢ÃƒÂ¢Ã¢â‚¬Å¡Ã‚Â¬Ãƒâ€¦Ã‚Â¡ÃƒÆ’Ã¢â‚¬Å¡Ãƒâ€šÃ‚Â¬ÃƒÆ’Ã†â€™ÃƒÂ¢Ã¢â€šÂ¬Ã‚Â¦ÃƒÆ’Ã¢â‚¬Å¡Ãƒâ€šÃ‚Â¡ÃƒÆ’Ã†â€™Ãƒâ€ Ã¢â‚¬â„¢ÃƒÆ’Ã¢â‚¬Â ÃƒÂ¢Ã¢â€šÂ¬Ã¢â€žÂ¢ÃƒÆ’Ã†â€™Ãƒâ€šÃ‚Â¢ÃƒÆ’Ã‚Â¢ÃƒÂ¢Ã¢â€šÂ¬Ã…Â¡Ãƒâ€šÃ‚Â¬ÃƒÆ’Ã¢â‚¬Â¦Ãƒâ€šÃ‚Â¡ÃƒÆ’Ã†â€™Ãƒâ€ Ã¢â‚¬â„¢ÃƒÆ’Ã‚Â¢ÃƒÂ¢Ã¢â‚¬Å¡Ã‚Â¬Ãƒâ€¦Ã‚Â¡ÃƒÆ’Ã†â€™ÃƒÂ¢Ã¢â€šÂ¬Ã…Â¡ÃƒÆ’Ã¢â‚¬Å¡Ãƒâ€šÃ‚Â°C) in two aquaculture systems, Integrated Multi-Trophic Aquaculture (IMTA) and Monoculture, over a seven-week period. Overall, both treatments exhibited a very similar pattern of fluctuation throughout the study. At the beginning (Week 1), water temperature was relatively high in both systems, with Monoculture showing a slightly higher value (approximately 28.7ÃƒÆ’Ã†â€™Ãƒâ€ Ã¢â‚¬â„¢ÃƒÆ’Ã¢â‚¬Â ÃƒÂ¢Ã¢â€šÂ¬Ã¢â€žÂ¢ÃƒÆ’Ã†â€™ÃƒÂ¢Ã¢â€šÂ¬Ã‚Â ÃƒÆ’Ã‚Â¢ÃƒÂ¢Ã¢â‚¬Å¡Ã‚Â¬ÃƒÂ¢Ã¢â‚¬Å¾Ã‚Â¢ÃƒÆ’Ã†â€™Ãƒâ€ Ã¢â‚¬â„¢ÃƒÆ’Ã‚Â¢ÃƒÂ¢Ã¢â‚¬Å¡Ã‚Â¬Ãƒâ€šÃ‚Â ÃƒÆ’Ã†â€™Ãƒâ€šÃ‚Â¢ÃƒÆ’Ã‚Â¢ÃƒÂ¢Ã¢â€šÂ¬Ã…Â¡Ãƒâ€šÃ‚Â¬ÃƒÆ’Ã‚Â¢ÃƒÂ¢Ã¢â€šÂ¬Ã…Â¾Ãƒâ€šÃ‚Â¢ÃƒÆ’Ã†â€™Ãƒâ€ Ã¢â‚¬â„¢ÃƒÆ’Ã¢â‚¬Â ÃƒÂ¢Ã¢â€šÂ¬Ã¢â€žÂ¢ÃƒÆ’Ã†â€™Ãƒâ€šÃ‚Â¢ÃƒÆ’Ã‚Â¢ÃƒÂ¢Ã¢â€šÂ¬Ã…Â¡Ãƒâ€šÃ‚Â¬ÃƒÆ’Ã¢â‚¬Å¡Ãƒâ€šÃ‚Â ÃƒÆ’Ã†â€™Ãƒâ€ Ã¢â‚¬â„¢ÃƒÆ’Ã¢â‚¬Å¡Ãƒâ€šÃ‚Â¢ÃƒÆ’Ã†â€™Ãƒâ€šÃ‚Â¢ÃƒÆ’Ã‚Â¢ÃƒÂ¢Ã¢â‚¬Å¡Ã‚Â¬Ãƒâ€¦Ã‚Â¡ÃƒÆ’Ã¢â‚¬Å¡Ãƒâ€šÃ‚Â¬ÃƒÆ’Ã†â€™Ãƒâ€šÃ‚Â¢ÃƒÆ’Ã‚Â¢ÃƒÂ¢Ã¢â‚¬Å¡Ã‚Â¬Ãƒâ€¦Ã‚Â¾ÃƒÆ’Ã¢â‚¬Å¡Ãƒâ€šÃ‚Â¢ÃƒÆ’Ã†â€™Ãƒâ€ Ã¢â‚¬â„¢ÃƒÆ’Ã¢â‚¬Â ÃƒÂ¢Ã¢â€šÂ¬Ã¢â€žÂ¢ÃƒÆ’Ã†â€™ÃƒÂ¢Ã¢â€šÂ¬Ã‚Â ÃƒÆ’Ã‚Â¢ÃƒÂ¢Ã¢â‚¬Å¡Ã‚Â¬ÃƒÂ¢Ã¢â‚¬Å¾Ã‚Â¢ÃƒÆ’Ã†â€™Ãƒâ€ Ã¢â‚¬â„¢ÃƒÆ’Ã‚Â¢ÃƒÂ¢Ã¢â‚¬Å¡Ã‚Â¬Ãƒâ€¦Ã‚Â¡ÃƒÆ’Ã†â€™ÃƒÂ¢Ã¢â€šÂ¬Ã…Â¡ÃƒÆ’Ã¢â‚¬Å¡Ãƒâ€šÃ‚Â¢ÃƒÆ’Ã†â€™Ãƒâ€ Ã¢â‚¬â„¢ÃƒÆ’Ã¢â‚¬Â ÃƒÂ¢Ã¢â€šÂ¬Ã¢â€žÂ¢ÃƒÆ’Ã†â€™ÃƒÂ¢Ã¢â€šÂ¬Ã…Â¡ÃƒÆ’Ã¢â‚¬Å¡Ãƒâ€šÃ‚Â¢ÃƒÆ’Ã†â€™Ãƒâ€ Ã¢â‚¬â„¢ÃƒÆ’Ã¢â‚¬Å¡Ãƒâ€šÃ‚Â¢ÃƒÆ’Ã†â€™Ãƒâ€šÃ‚Â¢ÃƒÆ’Ã‚Â¢ÃƒÂ¢Ã¢â‚¬Å¡Ã‚Â¬Ãƒâ€¦Ã‚Â¡ÃƒÆ’Ã¢â‚¬Å¡Ãƒâ€šÃ‚Â¬ÃƒÆ’Ã†â€™ÃƒÂ¢Ã¢â€šÂ¬Ã‚Â¦ÃƒÆ’Ã¢â‚¬Å¡Ãƒâ€šÃ‚Â¡ÃƒÆ’Ã†â€™Ãƒâ€ Ã¢â‚¬â„¢ÃƒÆ’Ã‚Â¢ÃƒÂ¢Ã¢â‚¬Å¡Ã‚Â¬Ãƒâ€¦Ã‚Â¡ÃƒÆ’Ã†â€™ÃƒÂ¢Ã¢â€šÂ¬Ã…Â¡ÃƒÆ’Ã¢â‚¬Å¡Ãƒâ€šÃ‚Â¬ÃƒÆ’Ã†â€™Ãƒâ€ Ã¢â‚¬â„¢ÃƒÆ’Ã¢â‚¬Â ÃƒÂ¢Ã¢â€šÂ¬Ã¢â€žÂ¢ÃƒÆ’Ã†â€™Ãƒâ€šÃ‚Â¢ÃƒÆ’Ã‚Â¢ÃƒÂ¢Ã¢â€šÂ¬Ã…Â¡Ãƒâ€šÃ‚Â¬ÃƒÆ’Ã¢â‚¬Å¡Ãƒâ€šÃ‚Â¦ÃƒÆ’Ã†â€™Ãƒâ€ Ã¢â‚¬â„¢ÃƒÆ’Ã‚Â¢ÃƒÂ¢Ã¢â‚¬Å¡Ã‚Â¬Ãƒâ€¦Ã‚Â¡ÃƒÆ’Ã†â€™ÃƒÂ¢Ã¢â€šÂ¬Ã…Â¡ÃƒÆ’Ã¢â‚¬Å¡Ãƒâ€šÃ‚Â¡ÃƒÆ’Ã†â€™Ãƒâ€ Ã¢â‚¬â„¢ÃƒÆ’Ã¢â‚¬Â ÃƒÂ¢Ã¢â€šÂ¬Ã¢â€žÂ¢ÃƒÆ’Ã†â€™ÃƒÂ¢Ã¢â€šÂ¬Ã‚Â ÃƒÆ’Ã‚Â¢ÃƒÂ¢Ã¢â‚¬Å¡Ã‚Â¬ÃƒÂ¢Ã¢â‚¬Å¾Ã‚Â¢ÃƒÆ’Ã†â€™Ãƒâ€ Ã¢â‚¬â„¢ÃƒÆ’Ã‚Â¢ÃƒÂ¢Ã¢â‚¬Å¡Ã‚Â¬Ãƒâ€šÃ‚Â ÃƒÆ’Ã†â€™Ãƒâ€šÃ‚Â¢ÃƒÆ’Ã‚Â¢ÃƒÂ¢Ã¢â€šÂ¬Ã…Â¡Ãƒâ€šÃ‚Â¬ÃƒÆ’Ã‚Â¢ÃƒÂ¢Ã¢â€šÂ¬Ã…Â¾Ãƒâ€šÃ‚Â¢ÃƒÆ’Ã†â€™Ãƒâ€ Ã¢â‚¬â„¢ÃƒÆ’Ã¢â‚¬Â ÃƒÂ¢Ã¢â€šÂ¬Ã¢â€žÂ¢ÃƒÆ’Ã†â€™ÃƒÂ¢Ã¢â€šÂ¬Ã…Â¡ÃƒÆ’Ã¢â‚¬Å¡Ãƒâ€šÃ‚Â¢ÃƒÆ’Ã†â€™Ãƒâ€ Ã¢â‚¬â„¢ÃƒÆ’Ã¢â‚¬Å¡Ãƒâ€šÃ‚Â¢ÃƒÆ’Ã†â€™Ãƒâ€šÃ‚Â¢ÃƒÆ’Ã‚Â¢ÃƒÂ¢Ã¢â€šÂ¬Ã…Â¡Ãƒâ€šÃ‚Â¬ÃƒÆ’Ã¢â‚¬Â¦Ãƒâ€šÃ‚Â¡ÃƒÆ’Ã†â€™ÃƒÂ¢Ã¢â€šÂ¬Ã…Â¡ÃƒÆ’Ã¢â‚¬Å¡Ãƒâ€šÃ‚Â¬ÃƒÆ’Ã†â€™Ãƒâ€ Ã¢â‚¬â„¢ÃƒÆ’Ã‚Â¢ÃƒÂ¢Ã¢â‚¬Å¡Ã‚Â¬Ãƒâ€šÃ‚Â¦ÃƒÆ’Ã†â€™ÃƒÂ¢Ã¢â€šÂ¬Ã…Â¡ÃƒÆ’Ã¢â‚¬Å¡Ãƒâ€šÃ‚Â¡ÃƒÆ’Ã†â€™Ãƒâ€ Ã¢â‚¬â„¢ÃƒÆ’Ã¢â‚¬Â ÃƒÂ¢Ã¢â€šÂ¬Ã¢â€žÂ¢ÃƒÆ’Ã†â€™ÃƒÂ¢Ã¢â€šÂ¬Ã‚Â ÃƒÆ’Ã‚Â¢ÃƒÂ¢Ã¢â‚¬Å¡Ã‚Â¬ÃƒÂ¢Ã¢â‚¬Å¾Ã‚Â¢ÃƒÆ’Ã†â€™Ãƒâ€ Ã¢â‚¬â„¢ÃƒÆ’Ã¢â‚¬Å¡Ãƒâ€šÃ‚Â¢ÃƒÆ’Ã†â€™Ãƒâ€šÃ‚Â¢ÃƒÆ’Ã‚Â¢ÃƒÂ¢Ã¢â‚¬Å¡Ã‚Â¬Ãƒâ€¦Ã‚Â¡ÃƒÆ’Ã¢â‚¬Å¡Ãƒâ€šÃ‚Â¬ÃƒÆ’Ã†â€™ÃƒÂ¢Ã¢â€šÂ¬Ã‚Â¦ÃƒÆ’Ã¢â‚¬Å¡Ãƒâ€šÃ‚Â¡ÃƒÆ’Ã†â€™Ãƒâ€ Ã¢â‚¬â„¢ÃƒÆ’Ã¢â‚¬Â ÃƒÂ¢Ã¢â€šÂ¬Ã¢â€žÂ¢ÃƒÆ’Ã†â€™Ãƒâ€šÃ‚Â¢ÃƒÆ’Ã‚Â¢ÃƒÂ¢Ã¢â€šÂ¬Ã…Â¡Ãƒâ€šÃ‚Â¬ÃƒÆ’Ã¢â‚¬Â¦Ãƒâ€šÃ‚Â¡ÃƒÆ’Ã†â€™Ãƒâ€ Ã¢â‚¬â„¢ÃƒÆ’Ã‚Â¢ÃƒÂ¢Ã¢â‚¬Å¡Ã‚Â¬Ãƒâ€¦Ã‚Â¡ÃƒÆ’Ã†â€™ÃƒÂ¢Ã¢â€šÂ¬Ã…Â¡ÃƒÆ’Ã¢â‚¬Å¡Ãƒâ€šÃ‚Â°C) compared to IMTA (around 28.2ÃƒÆ’Ã†â€™Ãƒâ€ Ã¢â‚¬â„¢ÃƒÆ’Ã¢â‚¬Â ÃƒÂ¢Ã¢â€šÂ¬Ã¢â€žÂ¢ÃƒÆ’Ã†â€™ÃƒÂ¢Ã¢â€šÂ¬Ã‚Â ÃƒÆ’Ã‚Â¢ÃƒÂ¢Ã¢â‚¬Å¡Ã‚Â¬ÃƒÂ¢Ã¢â‚¬Å¾Ã‚Â¢ÃƒÆ’Ã†â€™Ãƒâ€ Ã¢â‚¬â„¢ÃƒÆ’Ã‚Â¢ÃƒÂ¢Ã¢â‚¬Å¡Ã‚Â¬Ãƒâ€šÃ‚Â ÃƒÆ’Ã†â€™Ãƒâ€šÃ‚Â¢ÃƒÆ’Ã‚Â¢ÃƒÂ¢Ã¢â€šÂ¬Ã…Â¡Ãƒâ€šÃ‚Â¬ÃƒÆ’Ã‚Â¢ÃƒÂ¢Ã¢â€šÂ¬Ã…Â¾Ãƒâ€šÃ‚Â¢ÃƒÆ’Ã†â€™Ãƒâ€ Ã¢â‚¬â„¢ÃƒÆ’Ã¢â‚¬Â ÃƒÂ¢Ã¢â€šÂ¬Ã¢â€žÂ¢ÃƒÆ’Ã†â€™Ãƒâ€šÃ‚Â¢ÃƒÆ’Ã‚Â¢ÃƒÂ¢Ã¢â€šÂ¬Ã…Â¡Ãƒâ€šÃ‚Â¬ÃƒÆ’Ã¢â‚¬Å¡Ãƒâ€šÃ‚Â ÃƒÆ’Ã†â€™Ãƒâ€ Ã¢â‚¬â„¢ÃƒÆ’Ã¢â‚¬Å¡Ãƒâ€šÃ‚Â¢ÃƒÆ’Ã†â€™Ãƒâ€šÃ‚Â¢ÃƒÆ’Ã‚Â¢ÃƒÂ¢Ã¢â‚¬Å¡Ã‚Â¬Ãƒâ€¦Ã‚Â¡ÃƒÆ’Ã¢â‚¬Å¡Ãƒâ€šÃ‚Â¬ÃƒÆ’Ã†â€™Ãƒâ€šÃ‚Â¢ÃƒÆ’Ã‚Â¢ÃƒÂ¢Ã¢â‚¬Å¡Ã‚Â¬Ãƒâ€¦Ã‚Â¾ÃƒÆ’Ã¢â‚¬Å¡Ãƒâ€šÃ‚Â¢ÃƒÆ’Ã†â€™Ãƒâ€ Ã¢â‚¬â„¢ÃƒÆ’Ã¢â‚¬Â ÃƒÂ¢Ã¢â€šÂ¬Ã¢â€žÂ¢ÃƒÆ’Ã†â€™ÃƒÂ¢Ã¢â€šÂ¬Ã‚Â ÃƒÆ’Ã‚Â¢ÃƒÂ¢Ã¢â‚¬Å¡Ã‚Â¬ÃƒÂ¢Ã¢â‚¬Å¾Ã‚Â¢ÃƒÆ’Ã†â€™Ãƒâ€ Ã¢â‚¬â„¢ÃƒÆ’Ã‚Â¢ÃƒÂ¢Ã¢â‚¬Å¡Ã‚Â¬Ãƒâ€¦Ã‚Â¡ÃƒÆ’Ã†â€™ÃƒÂ¢Ã¢â€šÂ¬Ã…Â¡ÃƒÆ’Ã¢â‚¬Å¡Ãƒâ€šÃ‚Â¢ÃƒÆ’Ã†â€™Ãƒâ€ Ã¢â‚¬â„¢ÃƒÆ’Ã¢â‚¬Â ÃƒÂ¢Ã¢â€šÂ¬Ã¢â€žÂ¢ÃƒÆ’Ã†â€™ÃƒÂ¢Ã¢â€šÂ¬Ã…Â¡ÃƒÆ’Ã¢â‚¬Å¡Ãƒâ€šÃ‚Â¢ÃƒÆ’Ã†â€™Ãƒâ€ Ã¢â‚¬â„¢ÃƒÆ’Ã¢â‚¬Å¡Ãƒâ€šÃ‚Â¢ÃƒÆ’Ã†â€™Ãƒâ€šÃ‚Â¢ÃƒÆ’Ã‚Â¢ÃƒÂ¢Ã¢â‚¬Å¡Ã‚Â¬Ãƒâ€¦Ã‚Â¡ÃƒÆ’Ã¢â‚¬Å¡Ãƒâ€šÃ‚Â¬ÃƒÆ’Ã†â€™ÃƒÂ¢Ã¢â€šÂ¬Ã‚Â¦ÃƒÆ’Ã¢â‚¬Å¡Ãƒâ€šÃ‚Â¡ÃƒÆ’Ã†â€™Ãƒâ€ Ã¢â‚¬â„¢ÃƒÆ’Ã‚Â¢ÃƒÂ¢Ã¢â‚¬Å¡Ã‚Â¬Ãƒâ€¦Ã‚Â¡ÃƒÆ’Ã†â€™ÃƒÂ¢Ã¢â€šÂ¬Ã…Â¡ÃƒÆ’Ã¢â‚¬Å¡Ãƒâ€šÃ‚Â¬ÃƒÆ’Ã†â€™Ãƒâ€ Ã¢â‚¬â„¢ÃƒÆ’Ã¢â‚¬Â ÃƒÂ¢Ã¢â€šÂ¬Ã¢â€žÂ¢ÃƒÆ’Ã†â€™Ãƒâ€šÃ‚Â¢ÃƒÆ’Ã‚Â¢ÃƒÂ¢Ã¢â€šÂ¬Ã…Â¡Ãƒâ€šÃ‚Â¬ÃƒÆ’Ã¢â‚¬Å¡Ãƒâ€šÃ‚Â¦ÃƒÆ’Ã†â€™Ãƒâ€ Ã¢â‚¬â„¢ÃƒÆ’Ã‚Â¢ÃƒÂ¢Ã¢â‚¬Å¡Ã‚Â¬Ãƒâ€¦Ã‚Â¡ÃƒÆ’Ã†â€™ÃƒÂ¢Ã¢â€šÂ¬Ã…Â¡ÃƒÆ’Ã¢â‚¬Å¡Ãƒâ€šÃ‚Â¡ÃƒÆ’Ã†â€™Ãƒâ€ Ã¢â‚¬â„¢ÃƒÆ’Ã¢â‚¬Â ÃƒÂ¢Ã¢â€šÂ¬Ã¢â€žÂ¢ÃƒÆ’Ã†â€™ÃƒÂ¢Ã¢â€šÂ¬Ã‚Â ÃƒÆ’Ã‚Â¢ÃƒÂ¢Ã¢â‚¬Å¡Ã‚Â¬ÃƒÂ¢Ã¢â‚¬Å¾Ã‚Â¢ÃƒÆ’Ã†â€™Ãƒâ€ Ã¢â‚¬â„¢ÃƒÆ’Ã‚Â¢ÃƒÂ¢Ã¢â‚¬Å¡Ã‚Â¬Ãƒâ€šÃ‚Â ÃƒÆ’Ã†â€™Ãƒâ€šÃ‚Â¢ÃƒÆ’Ã‚Â¢ÃƒÂ¢Ã¢â€šÂ¬Ã…Â¡Ãƒâ€šÃ‚Â¬ÃƒÆ’Ã‚Â¢ÃƒÂ¢Ã¢â€šÂ¬Ã…Â¾Ãƒâ€šÃ‚Â¢ÃƒÆ’Ã†â€™Ãƒâ€ Ã¢â‚¬â„¢ÃƒÆ’Ã¢â‚¬Â ÃƒÂ¢Ã¢â€šÂ¬Ã¢â€žÂ¢ÃƒÆ’Ã†â€™ÃƒÂ¢Ã¢â€šÂ¬Ã…Â¡ÃƒÆ’Ã¢â‚¬Å¡Ãƒâ€šÃ‚Â¢ÃƒÆ’Ã†â€™Ãƒâ€ Ã¢â‚¬â„¢ÃƒÆ’Ã¢â‚¬Å¡Ãƒâ€šÃ‚Â¢ÃƒÆ’Ã†â€™Ãƒâ€šÃ‚Â¢ÃƒÆ’Ã‚Â¢ÃƒÂ¢Ã¢â€šÂ¬Ã…Â¡Ãƒâ€šÃ‚Â¬ÃƒÆ’Ã¢â‚¬Â¦Ãƒâ€šÃ‚Â¡ÃƒÆ’Ã†â€™ÃƒÂ¢Ã¢â€šÂ¬Ã…Â¡ÃƒÆ’Ã¢â‚¬Å¡Ãƒâ€šÃ‚Â¬ÃƒÆ’Ã†â€™Ãƒâ€ Ã¢â‚¬â„¢ÃƒÆ’Ã‚Â¢ÃƒÂ¢Ã¢â‚¬Å¡Ã‚Â¬Ãƒâ€šÃ‚Â¦ÃƒÆ’Ã†â€™ÃƒÂ¢Ã¢â€šÂ¬Ã…Â¡ÃƒÆ’Ã¢â‚¬Å¡Ãƒâ€šÃ‚Â¡ÃƒÆ’Ã†â€™Ãƒâ€ Ã¢â‚¬â„¢ÃƒÆ’Ã¢â‚¬Â ÃƒÂ¢Ã¢â€šÂ¬Ã¢â€žÂ¢ÃƒÆ’Ã†â€™ÃƒÂ¢Ã¢â€šÂ¬Ã‚Â ÃƒÆ’Ã‚Â¢ÃƒÂ¢Ã¢â‚¬Å¡Ã‚Â¬ÃƒÂ¢Ã¢â‚¬Å¾Ã‚Â¢ÃƒÆ’Ã†â€™Ãƒâ€ Ã¢â‚¬â„¢ÃƒÆ’Ã¢â‚¬Å¡Ãƒâ€šÃ‚Â¢ÃƒÆ’Ã†â€™Ãƒâ€šÃ‚Â¢ÃƒÆ’Ã‚Â¢ÃƒÂ¢Ã¢â‚¬Å¡Ã‚Â¬Ãƒâ€¦Ã‚Â¡ÃƒÆ’Ã¢â‚¬Å¡Ãƒâ€šÃ‚Â¬ÃƒÆ’Ã†â€™ÃƒÂ¢Ã¢â€šÂ¬Ã‚Â¦ÃƒÆ’Ã¢â‚¬Å¡Ãƒâ€šÃ‚Â¡ÃƒÆ’Ã†â€™Ãƒâ€ Ã¢â‚¬â„¢ÃƒÆ’Ã¢â‚¬Â ÃƒÂ¢Ã¢â€šÂ¬Ã¢â€žÂ¢ÃƒÆ’Ã†â€™Ãƒâ€šÃ‚Â¢ÃƒÆ’Ã‚Â¢ÃƒÂ¢Ã¢â€šÂ¬Ã…Â¡Ãƒâ€šÃ‚Â¬ÃƒÆ’Ã¢â‚¬Â¦Ãƒâ€šÃ‚Â¡ÃƒÆ’Ã†â€™Ãƒâ€ Ã¢â‚¬â„¢ÃƒÆ’Ã‚Â¢ÃƒÂ¢Ã¢â‚¬Å¡Ã‚Â¬Ãƒâ€¦Ã‚Â¡ÃƒÆ’Ã†â€™ÃƒÂ¢Ã¢â€šÂ¬Ã…Â¡ÃƒÆ’Ã¢â‚¬Å¡Ãƒâ€šÃ‚Â°C). From Week 1 to Week 4, a clear declining trend was observed in both treatments, reaching the lowest temperatures at Week 4 (about 25.9ÃƒÆ’Ã†â€™Ãƒâ€ Ã¢â‚¬â„¢ÃƒÆ’Ã¢â‚¬Â ÃƒÂ¢Ã¢â€šÂ¬Ã¢â€žÂ¢ÃƒÆ’Ã†â€™ÃƒÂ¢Ã¢â€šÂ¬Ã‚Â ÃƒÆ’Ã‚Â¢ÃƒÂ¢Ã¢â‚¬Å¡Ã‚Â¬ÃƒÂ¢Ã¢â‚¬Å¾Ã‚Â¢ÃƒÆ’Ã†â€™Ãƒâ€ Ã¢â‚¬â„¢ÃƒÆ’Ã‚Â¢ÃƒÂ¢Ã¢â‚¬Å¡Ã‚Â¬Ãƒâ€šÃ‚Â ÃƒÆ’Ã†â€™Ãƒâ€šÃ‚Â¢ÃƒÆ’Ã‚Â¢ÃƒÂ¢Ã¢â€šÂ¬Ã…Â¡Ãƒâ€šÃ‚Â¬ÃƒÆ’Ã‚Â¢ÃƒÂ¢Ã¢â€šÂ¬Ã…Â¾Ãƒâ€šÃ‚Â¢ÃƒÆ’Ã†â€™Ãƒâ€ Ã¢â‚¬â„¢ÃƒÆ’Ã¢â‚¬Â ÃƒÂ¢Ã¢â€šÂ¬Ã¢â€žÂ¢ÃƒÆ’Ã†â€™Ãƒâ€šÃ‚Â¢ÃƒÆ’Ã‚Â¢ÃƒÂ¢Ã¢â€šÂ¬Ã…Â¡Ãƒâ€šÃ‚Â¬ÃƒÆ’Ã¢â‚¬Å¡Ãƒâ€šÃ‚Â ÃƒÆ’Ã†â€™Ãƒâ€ Ã¢â‚¬â„¢ÃƒÆ’Ã¢â‚¬Å¡Ãƒâ€šÃ‚Â¢ÃƒÆ’Ã†â€™Ãƒâ€šÃ‚Â¢ÃƒÆ’Ã‚Â¢ÃƒÂ¢Ã¢â‚¬Å¡Ã‚Â¬Ãƒâ€¦Ã‚Â¡ÃƒÆ’Ã¢â‚¬Å¡Ãƒâ€šÃ‚Â¬ÃƒÆ’Ã†â€™Ãƒâ€šÃ‚Â¢ÃƒÆ’Ã‚Â¢ÃƒÂ¢Ã¢â‚¬Å¡Ã‚Â¬Ãƒâ€¦Ã‚Â¾ÃƒÆ’Ã¢â‚¬Å¡Ãƒâ€šÃ‚Â¢ÃƒÆ’Ã†â€™Ãƒâ€ Ã¢â‚¬â„¢ÃƒÆ’Ã¢â‚¬Â ÃƒÂ¢Ã¢â€šÂ¬Ã¢â€žÂ¢ÃƒÆ’Ã†â€™ÃƒÂ¢Ã¢â€šÂ¬Ã‚Â ÃƒÆ’Ã‚Â¢ÃƒÂ¢Ã¢â‚¬Å¡Ã‚Â¬ÃƒÂ¢Ã¢â‚¬Å¾Ã‚Â¢ÃƒÆ’Ã†â€™Ãƒâ€ Ã¢â‚¬â„¢ÃƒÆ’Ã‚Â¢ÃƒÂ¢Ã¢â‚¬Å¡Ã‚Â¬Ãƒâ€¦Ã‚Â¡ÃƒÆ’Ã†â€™ÃƒÂ¢Ã¢â€šÂ¬Ã…Â¡ÃƒÆ’Ã¢â‚¬Å¡Ãƒâ€šÃ‚Â¢ÃƒÆ’Ã†â€™Ãƒâ€ Ã¢â‚¬â„¢ÃƒÆ’Ã¢â‚¬Â ÃƒÂ¢Ã¢â€šÂ¬Ã¢â€žÂ¢ÃƒÆ’Ã†â€™ÃƒÂ¢Ã¢â€šÂ¬Ã…Â¡ÃƒÆ’Ã¢â‚¬Å¡Ãƒâ€šÃ‚Â¢ÃƒÆ’Ã†â€™Ãƒâ€ Ã¢â‚¬â„¢ÃƒÆ’Ã¢â‚¬Å¡Ãƒâ€šÃ‚Â¢ÃƒÆ’Ã†â€™Ãƒâ€šÃ‚Â¢ÃƒÆ’Ã‚Â¢ÃƒÂ¢Ã¢â‚¬Å¡Ã‚Â¬Ãƒâ€¦Ã‚Â¡ÃƒÆ’Ã¢â‚¬Å¡Ãƒâ€šÃ‚Â¬ÃƒÆ’Ã†â€™ÃƒÂ¢Ã¢â€šÂ¬Ã‚Â¦ÃƒÆ’Ã¢â‚¬Å¡Ãƒâ€šÃ‚Â¡ÃƒÆ’Ã†â€™Ãƒâ€ Ã¢â‚¬â„¢ÃƒÆ’Ã‚Â¢ÃƒÂ¢Ã¢â‚¬Å¡Ã‚Â¬Ãƒâ€¦Ã‚Â¡ÃƒÆ’Ã†â€™ÃƒÂ¢Ã¢â€šÂ¬Ã…Â¡ÃƒÆ’Ã¢â‚¬Å¡Ãƒâ€šÃ‚Â¬ÃƒÆ’Ã†â€™Ãƒâ€ Ã¢â‚¬â„¢ÃƒÆ’Ã¢â‚¬Â ÃƒÂ¢Ã¢â€šÂ¬Ã¢â€žÂ¢ÃƒÆ’Ã†â€™Ãƒâ€šÃ‚Â¢ÃƒÆ’Ã‚Â¢ÃƒÂ¢Ã¢â€šÂ¬Ã…Â¡Ãƒâ€šÃ‚Â¬ÃƒÆ’Ã¢â‚¬Å¡Ãƒâ€šÃ‚Â¦ÃƒÆ’Ã†â€™Ãƒâ€ Ã¢â‚¬â„¢ÃƒÆ’Ã‚Â¢ÃƒÂ¢Ã¢â‚¬Å¡Ã‚Â¬Ãƒâ€¦Ã‚Â¡ÃƒÆ’Ã†â€™ÃƒÂ¢Ã¢â€šÂ¬Ã…Â¡ÃƒÆ’Ã¢â‚¬Å¡Ãƒâ€šÃ‚Â¡ÃƒÆ’Ã†â€™Ãƒâ€ Ã¢â‚¬â„¢ÃƒÆ’Ã¢â‚¬Â ÃƒÂ¢Ã¢â€šÂ¬Ã¢â€žÂ¢ÃƒÆ’Ã†â€™ÃƒÂ¢Ã¢â€šÂ¬Ã‚Â ÃƒÆ’Ã‚Â¢ÃƒÂ¢Ã¢â‚¬Å¡Ã‚Â¬ÃƒÂ¢Ã¢â‚¬Å¾Ã‚Â¢ÃƒÆ’Ã†â€™Ãƒâ€ Ã¢â‚¬â„¢ÃƒÆ’Ã‚Â¢ÃƒÂ¢Ã¢â‚¬Å¡Ã‚Â¬Ãƒâ€šÃ‚Â ÃƒÆ’Ã†â€™Ãƒâ€šÃ‚Â¢ÃƒÆ’Ã‚Â¢ÃƒÂ¢Ã¢â€šÂ¬Ã…Â¡Ãƒâ€šÃ‚Â¬ÃƒÆ’Ã‚Â¢ÃƒÂ¢Ã¢â€šÂ¬Ã…Â¾Ãƒâ€šÃ‚Â¢ÃƒÆ’Ã†â€™Ãƒâ€ Ã¢â‚¬â„¢ÃƒÆ’Ã¢â‚¬Â ÃƒÂ¢Ã¢â€šÂ¬Ã¢â€žÂ¢ÃƒÆ’Ã†â€™ÃƒÂ¢Ã¢â€šÂ¬Ã…Â¡ÃƒÆ’Ã¢â‚¬Å¡Ãƒâ€šÃ‚Â¢ÃƒÆ’Ã†â€™Ãƒâ€ Ã¢â‚¬â„¢ÃƒÆ’Ã¢â‚¬Å¡Ãƒâ€šÃ‚Â¢ÃƒÆ’Ã†â€™Ãƒâ€šÃ‚Â¢ÃƒÆ’Ã‚Â¢ÃƒÂ¢Ã¢â€šÂ¬Ã…Â¡Ãƒâ€šÃ‚Â¬ÃƒÆ’Ã¢â‚¬Â¦Ãƒâ€šÃ‚Â¡ÃƒÆ’Ã†â€™ÃƒÂ¢Ã¢â€šÂ¬Ã…Â¡ÃƒÆ’Ã¢â‚¬Å¡Ãƒâ€šÃ‚Â¬ÃƒÆ’Ã†â€™Ãƒâ€ Ã¢â‚¬â„¢ÃƒÆ’Ã‚Â¢ÃƒÂ¢Ã¢â‚¬Å¡Ã‚Â¬Ãƒâ€šÃ‚Â¦ÃƒÆ’Ã†â€™ÃƒÂ¢Ã¢â€šÂ¬Ã…Â¡ÃƒÆ’Ã¢â‚¬Å¡Ãƒâ€šÃ‚Â¡ÃƒÆ’Ã†â€™Ãƒâ€ Ã¢â‚¬â„¢ÃƒÆ’Ã¢â‚¬Â ÃƒÂ¢Ã¢â€šÂ¬Ã¢â€žÂ¢ÃƒÆ’Ã†â€™ÃƒÂ¢Ã¢â€šÂ¬Ã‚Â ÃƒÆ’Ã‚Â¢ÃƒÂ¢Ã¢â‚¬Å¡Ã‚Â¬ÃƒÂ¢Ã¢â‚¬Å¾Ã‚Â¢ÃƒÆ’Ã†â€™Ãƒâ€ Ã¢â‚¬â„¢ÃƒÆ’Ã¢â‚¬Å¡Ãƒâ€šÃ‚Â¢ÃƒÆ’Ã†â€™Ãƒâ€šÃ‚Â¢ÃƒÆ’Ã‚Â¢ÃƒÂ¢Ã¢â‚¬Å¡Ã‚Â¬Ãƒâ€¦Ã‚Â¡ÃƒÆ’Ã¢â‚¬Å¡Ãƒâ€šÃ‚Â¬ÃƒÆ’Ã†â€™ÃƒÂ¢Ã¢â€šÂ¬Ã‚Â¦ÃƒÆ’Ã¢â‚¬Å¡Ãƒâ€šÃ‚Â¡ÃƒÆ’Ã†â€™Ãƒâ€ Ã¢â‚¬â„¢ÃƒÆ’Ã¢â‚¬Â ÃƒÂ¢Ã¢â€šÂ¬Ã¢â€žÂ¢ÃƒÆ’Ã†â€™Ãƒâ€šÃ‚Â¢ÃƒÆ’Ã‚Â¢ÃƒÂ¢Ã¢â€šÂ¬Ã…Â¡Ãƒâ€šÃ‚Â¬ÃƒÆ’Ã¢â‚¬Â¦Ãƒâ€šÃ‚Â¡ÃƒÆ’Ã†â€™Ãƒâ€ Ã¢â‚¬â„¢ÃƒÆ’Ã‚Â¢ÃƒÂ¢Ã¢â‚¬Å¡Ã‚Â¬Ãƒâ€¦Ã‚Â¡ÃƒÆ’Ã†â€™ÃƒÂ¢Ã¢â€šÂ¬Ã…Â¡ÃƒÆ’Ã¢â‚¬Å¡Ãƒâ€šÃ‚Â°C in Monoculture and 25.7ÃƒÆ’Ã†â€™Ãƒâ€ Ã¢â‚¬â„¢ÃƒÆ’Ã¢â‚¬Â ÃƒÂ¢Ã¢â€šÂ¬Ã¢â€žÂ¢ÃƒÆ’Ã†â€™ÃƒÂ¢Ã¢â€šÂ¬Ã‚Â ÃƒÆ’Ã‚Â¢ÃƒÂ¢Ã¢â‚¬Å¡Ã‚Â¬ÃƒÂ¢Ã¢â‚¬Å¾Ã‚Â¢ÃƒÆ’Ã†â€™Ãƒâ€ Ã¢â‚¬â„¢ÃƒÆ’Ã‚Â¢ÃƒÂ¢Ã¢â‚¬Å¡Ã‚Â¬Ãƒâ€šÃ‚Â ÃƒÆ’Ã†â€™Ãƒâ€šÃ‚Â¢ÃƒÆ’Ã‚Â¢ÃƒÂ¢Ã¢â€šÂ¬Ã…Â¡Ãƒâ€šÃ‚Â¬ÃƒÆ’Ã‚Â¢ÃƒÂ¢Ã¢â€šÂ¬Ã…Â¾Ãƒâ€šÃ‚Â¢ÃƒÆ’Ã†â€™Ãƒâ€ Ã¢â‚¬â„¢ÃƒÆ’Ã¢â‚¬Â ÃƒÂ¢Ã¢â€šÂ¬Ã¢â€žÂ¢ÃƒÆ’Ã†â€™Ãƒâ€šÃ‚Â¢ÃƒÆ’Ã‚Â¢ÃƒÂ¢Ã¢â€šÂ¬Ã…Â¡Ãƒâ€šÃ‚Â¬ÃƒÆ’Ã¢â‚¬Å¡Ãƒâ€šÃ‚Â ÃƒÆ’Ã†â€™Ãƒâ€ Ã¢â‚¬â„¢ÃƒÆ’Ã¢â‚¬Å¡Ãƒâ€šÃ‚Â¢ÃƒÆ’Ã†â€™Ãƒâ€šÃ‚Â¢ÃƒÆ’Ã‚Â¢ÃƒÂ¢Ã¢â‚¬Å¡Ã‚Â¬Ãƒâ€¦Ã‚Â¡ÃƒÆ’Ã¢â‚¬Å¡Ãƒâ€šÃ‚Â¬ÃƒÆ’Ã†â€™Ãƒâ€šÃ‚Â¢ÃƒÆ’Ã‚Â¢ÃƒÂ¢Ã¢â‚¬Å¡Ã‚Â¬Ãƒâ€¦Ã‚Â¾ÃƒÆ’Ã¢â‚¬Å¡Ãƒâ€šÃ‚Â¢ÃƒÆ’Ã†â€™Ãƒâ€ Ã¢â‚¬â„¢ÃƒÆ’Ã¢â‚¬Â ÃƒÂ¢Ã¢â€šÂ¬Ã¢â€žÂ¢ÃƒÆ’Ã†â€™ÃƒÂ¢Ã¢â€šÂ¬Ã‚Â ÃƒÆ’Ã‚Â¢ÃƒÂ¢Ã¢â‚¬Å¡Ã‚Â¬ÃƒÂ¢Ã¢â‚¬Å¾Ã‚Â¢ÃƒÆ’Ã†â€™Ãƒâ€ Ã¢â‚¬â„¢ÃƒÆ’Ã‚Â¢ÃƒÂ¢Ã¢â‚¬Å¡Ã‚Â¬Ãƒâ€¦Ã‚Â¡ÃƒÆ’Ã†â€™ÃƒÂ¢Ã¢â€šÂ¬Ã…Â¡ÃƒÆ’Ã¢â‚¬Å¡Ãƒâ€šÃ‚Â¢ÃƒÆ’Ã†â€™Ãƒâ€ Ã¢â‚¬â„¢ÃƒÆ’Ã¢â‚¬Â ÃƒÂ¢Ã¢â€šÂ¬Ã¢â€žÂ¢ÃƒÆ’Ã†â€™ÃƒÂ¢Ã¢â€šÂ¬Ã…Â¡ÃƒÆ’Ã¢â‚¬Å¡Ãƒâ€šÃ‚Â¢ÃƒÆ’Ã†â€™Ãƒâ€ Ã¢â‚¬â„¢ÃƒÆ’Ã¢â‚¬Å¡Ãƒâ€šÃ‚Â¢ÃƒÆ’Ã†â€™Ãƒâ€šÃ‚Â¢ÃƒÆ’Ã‚Â¢ÃƒÂ¢Ã¢â‚¬Å¡Ã‚Â¬Ãƒâ€¦Ã‚Â¡ÃƒÆ’Ã¢â‚¬Å¡Ãƒâ€šÃ‚Â¬ÃƒÆ’Ã†â€™ÃƒÂ¢Ã¢â€šÂ¬Ã‚Â¦ÃƒÆ’Ã¢â‚¬Å¡Ãƒâ€šÃ‚Â¡ÃƒÆ’Ã†â€™Ãƒâ€ Ã¢â‚¬â„¢ÃƒÆ’Ã‚Â¢ÃƒÂ¢Ã¢â‚¬Å¡Ã‚Â¬Ãƒâ€¦Ã‚Â¡ÃƒÆ’Ã†â€™ÃƒÂ¢Ã¢â€šÂ¬Ã…Â¡ÃƒÆ’Ã¢â‚¬Å¡Ãƒâ€šÃ‚Â¬ÃƒÆ’Ã†â€™Ãƒâ€ Ã¢â‚¬â„¢ÃƒÆ’Ã¢â‚¬Â ÃƒÂ¢Ã¢â€šÂ¬Ã¢â€žÂ¢ÃƒÆ’Ã†â€™Ãƒâ€šÃ‚Â¢ÃƒÆ’Ã‚Â¢ÃƒÂ¢Ã¢â€šÂ¬Ã…Â¡Ãƒâ€šÃ‚Â¬ÃƒÆ’Ã¢â‚¬Å¡Ãƒâ€šÃ‚Â¦ÃƒÆ’Ã†â€™Ãƒâ€ Ã¢â‚¬â„¢ÃƒÆ’Ã‚Â¢ÃƒÂ¢Ã¢â‚¬Å¡Ã‚Â¬Ãƒâ€¦Ã‚Â¡ÃƒÆ’Ã†â€™ÃƒÂ¢Ã¢â€šÂ¬Ã…Â¡ÃƒÆ’Ã¢â‚¬Å¡Ãƒâ€šÃ‚Â¡ÃƒÆ’Ã†â€™Ãƒâ€ Ã¢â‚¬â„¢ÃƒÆ’Ã¢â‚¬Â ÃƒÂ¢Ã¢â€šÂ¬Ã¢â€žÂ¢ÃƒÆ’Ã†â€™ÃƒÂ¢Ã¢â€šÂ¬Ã‚Â ÃƒÆ’Ã‚Â¢ÃƒÂ¢Ã¢â‚¬Å¡Ã‚Â¬ÃƒÂ¢Ã¢â‚¬Å¾Ã‚Â¢ÃƒÆ’Ã†â€™Ãƒâ€ Ã¢â‚¬â„¢ÃƒÆ’Ã‚Â¢ÃƒÂ¢Ã¢â‚¬Å¡Ã‚Â¬Ãƒâ€šÃ‚Â ÃƒÆ’Ã†â€™Ãƒâ€šÃ‚Â¢ÃƒÆ’Ã‚Â¢ÃƒÂ¢Ã¢â€šÂ¬Ã…Â¡Ãƒâ€šÃ‚Â¬ÃƒÆ’Ã‚Â¢ÃƒÂ¢Ã¢â€šÂ¬Ã…Â¾Ãƒâ€šÃ‚Â¢ÃƒÆ’Ã†â€™Ãƒâ€ Ã¢â‚¬â„¢ÃƒÆ’Ã¢â‚¬Â ÃƒÂ¢Ã¢â€šÂ¬Ã¢â€žÂ¢ÃƒÆ’Ã†â€™ÃƒÂ¢Ã¢â€šÂ¬Ã…Â¡ÃƒÆ’Ã¢â‚¬Å¡Ãƒâ€šÃ‚Â¢ÃƒÆ’Ã†â€™Ãƒâ€ Ã¢â‚¬â„¢ÃƒÆ’Ã¢â‚¬Å¡Ãƒâ€šÃ‚Â¢ÃƒÆ’Ã†â€™Ãƒâ€šÃ‚Â¢ÃƒÆ’Ã‚Â¢ÃƒÂ¢Ã¢â€šÂ¬Ã…Â¡Ãƒâ€šÃ‚Â¬ÃƒÆ’Ã¢â‚¬Â¦Ãƒâ€šÃ‚Â¡ÃƒÆ’Ã†â€™ÃƒÂ¢Ã¢â€šÂ¬Ã…Â¡ÃƒÆ’Ã¢â‚¬Å¡Ãƒâ€šÃ‚Â¬ÃƒÆ’Ã†â€™Ãƒâ€ Ã¢â‚¬â„¢ÃƒÆ’Ã‚Â¢ÃƒÂ¢Ã¢â‚¬Å¡Ã‚Â¬Ãƒâ€šÃ‚Â¦ÃƒÆ’Ã†â€™ÃƒÂ¢Ã¢â€šÂ¬Ã…Â¡ÃƒÆ’Ã¢â‚¬Å¡Ãƒâ€šÃ‚Â¡ÃƒÆ’Ã†â€™Ãƒâ€ Ã¢â‚¬â„¢ÃƒÆ’Ã¢â‚¬Â ÃƒÂ¢Ã¢â€šÂ¬Ã¢â€žÂ¢ÃƒÆ’Ã†â€™ÃƒÂ¢Ã¢â€šÂ¬Ã‚Â ÃƒÆ’Ã‚Â¢ÃƒÂ¢Ã¢â‚¬Å¡Ã‚Â¬ÃƒÂ¢Ã¢â‚¬Å¾Ã‚Â¢ÃƒÆ’Ã†â€™Ãƒâ€ Ã¢â‚¬â„¢ÃƒÆ’Ã¢â‚¬Å¡Ãƒâ€šÃ‚Â¢ÃƒÆ’Ã†â€™Ãƒâ€šÃ‚Â¢ÃƒÆ’Ã‚Â¢ÃƒÂ¢Ã¢â‚¬Å¡Ã‚Â¬Ãƒâ€¦Ã‚Â¡ÃƒÆ’Ã¢â‚¬Å¡Ãƒâ€šÃ‚Â¬ÃƒÆ’Ã†â€™ÃƒÂ¢Ã¢â€šÂ¬Ã‚Â¦ÃƒÆ’Ã¢â‚¬Å¡Ãƒâ€šÃ‚Â¡ÃƒÆ’Ã†â€™Ãƒâ€ Ã¢â‚¬â„¢ÃƒÆ’Ã¢â‚¬Â ÃƒÂ¢Ã¢â€šÂ¬Ã¢â€žÂ¢ÃƒÆ’Ã†â€™Ãƒâ€šÃ‚Â¢ÃƒÆ’Ã‚Â¢ÃƒÂ¢Ã¢â€šÂ¬Ã…Â¡Ãƒâ€šÃ‚Â¬ÃƒÆ’Ã¢â‚¬Â¦Ãƒâ€šÃ‚Â¡ÃƒÆ’Ã†â€™Ãƒâ€ Ã¢â‚¬â„¢ÃƒÆ’Ã‚Â¢ÃƒÂ¢Ã¢â‚¬Å¡Ã‚Â¬Ãƒâ€¦Ã‚Â¡ÃƒÆ’Ã†â€™ÃƒÂ¢Ã¢â€šÂ¬Ã…Â¡ÃƒÆ’Ã¢â‚¬Å¡Ãƒâ€šÃ‚Â°C in IMTA). Following this decline, temperatures increased sharply in Week 5 and then remained relatively stable through Weeks 6 and 7 at approximately 28.1ÃƒÆ’Ã†â€™Ãƒâ€ Ã¢â‚¬â„¢ÃƒÆ’Ã¢â‚¬Â ÃƒÂ¢Ã¢â€šÂ¬Ã¢â€žÂ¢ÃƒÆ’Ã†â€™ÃƒÂ¢Ã¢â€šÂ¬Ã‚Â ÃƒÆ’Ã‚Â¢ÃƒÂ¢Ã¢â‚¬Å¡Ã‚Â¬ÃƒÂ¢Ã¢â‚¬Å¾Ã‚Â¢ÃƒÆ’Ã†â€™Ãƒâ€ Ã¢â‚¬â„¢ÃƒÆ’Ã‚Â¢ÃƒÂ¢Ã¢â‚¬Å¡Ã‚Â¬Ãƒâ€šÃ‚Â ÃƒÆ’Ã†â€™Ãƒâ€šÃ‚Â¢ÃƒÆ’Ã‚Â¢ÃƒÂ¢Ã¢â€šÂ¬Ã…Â¡Ãƒâ€šÃ‚Â¬ÃƒÆ’Ã‚Â¢ÃƒÂ¢Ã¢â€šÂ¬Ã…Â¾Ãƒâ€šÃ‚Â¢ÃƒÆ’Ã†â€™Ãƒâ€ Ã¢â‚¬â„¢ÃƒÆ’Ã¢â‚¬Â ÃƒÂ¢Ã¢â€šÂ¬Ã¢â€žÂ¢ÃƒÆ’Ã†â€™Ãƒâ€šÃ‚Â¢ÃƒÆ’Ã‚Â¢ÃƒÂ¢Ã¢â€šÂ¬Ã…Â¡Ãƒâ€šÃ‚Â¬ÃƒÆ’Ã¢â‚¬Å¡Ãƒâ€šÃ‚Â ÃƒÆ’Ã†â€™Ãƒâ€ Ã¢â‚¬â„¢ÃƒÆ’Ã¢â‚¬Å¡Ãƒâ€šÃ‚Â¢ÃƒÆ’Ã†â€™Ãƒâ€šÃ‚Â¢ÃƒÆ’Ã‚Â¢ÃƒÂ¢Ã¢â‚¬Å¡Ã‚Â¬Ãƒâ€¦Ã‚Â¡ÃƒÆ’Ã¢â‚¬Å¡Ãƒâ€šÃ‚Â¬ÃƒÆ’Ã†â€™Ãƒâ€šÃ‚Â¢ÃƒÆ’Ã‚Â¢ÃƒÂ¢Ã¢â‚¬Å¡Ã‚Â¬Ãƒâ€¦Ã‚Â¾ÃƒÆ’Ã¢â‚¬Å¡Ãƒâ€šÃ‚Â¢ÃƒÆ’Ã†â€™Ãƒâ€ Ã¢â‚¬â„¢ÃƒÆ’Ã¢â‚¬Â ÃƒÂ¢Ã¢â€šÂ¬Ã¢â€žÂ¢ÃƒÆ’Ã†â€™ÃƒÂ¢Ã¢â€šÂ¬Ã‚Â ÃƒÆ’Ã‚Â¢ÃƒÂ¢Ã¢â‚¬Å¡Ã‚Â¬ÃƒÂ¢Ã¢â‚¬Å¾Ã‚Â¢ÃƒÆ’Ã†â€™Ãƒâ€ Ã¢â‚¬â„¢ÃƒÆ’Ã‚Â¢ÃƒÂ¢Ã¢â‚¬Å¡Ã‚Â¬Ãƒâ€¦Ã‚Â¡ÃƒÆ’Ã†â€™ÃƒÂ¢Ã¢â€šÂ¬Ã…Â¡ÃƒÆ’Ã¢â‚¬Å¡Ãƒâ€šÃ‚Â¢ÃƒÆ’Ã†â€™Ãƒâ€ Ã¢â‚¬â„¢ÃƒÆ’Ã¢â‚¬Â ÃƒÂ¢Ã¢â€šÂ¬Ã¢â€žÂ¢ÃƒÆ’Ã†â€™ÃƒÂ¢Ã¢â€šÂ¬Ã…Â¡ÃƒÆ’Ã¢â‚¬Å¡Ãƒâ€šÃ‚Â¢ÃƒÆ’Ã†â€™Ãƒâ€ Ã¢â‚¬â„¢ÃƒÆ’Ã¢â‚¬Å¡Ãƒâ€šÃ‚Â¢ÃƒÆ’Ã†â€™Ãƒâ€šÃ‚Â¢ÃƒÆ’Ã‚Â¢ÃƒÂ¢Ã¢â‚¬Å¡Ã‚Â¬Ãƒâ€¦Ã‚Â¡ÃƒÆ’Ã¢â‚¬Å¡Ãƒâ€šÃ‚Â¬ÃƒÆ’Ã†â€™ÃƒÂ¢Ã¢â€šÂ¬Ã‚Â¦ÃƒÆ’Ã¢â‚¬Å¡Ãƒâ€šÃ‚Â¡ÃƒÆ’Ã†â€™Ãƒâ€ Ã¢â‚¬â„¢ÃƒÆ’Ã‚Â¢ÃƒÂ¢Ã¢â‚¬Å¡Ã‚Â¬Ãƒâ€¦Ã‚Â¡ÃƒÆ’Ã†â€™ÃƒÂ¢Ã¢â€šÂ¬Ã…Â¡ÃƒÆ’Ã¢â‚¬Å¡Ãƒâ€šÃ‚Â¬ÃƒÆ’Ã†â€™Ãƒâ€ Ã¢â‚¬â„¢ÃƒÆ’Ã¢â‚¬Â ÃƒÂ¢Ã¢â€šÂ¬Ã¢â€žÂ¢ÃƒÆ’Ã†â€™Ãƒâ€šÃ‚Â¢ÃƒÆ’Ã‚Â¢ÃƒÂ¢Ã¢â€šÂ¬Ã…Â¡Ãƒâ€šÃ‚Â¬ÃƒÆ’Ã¢â‚¬Å¡Ãƒâ€šÃ‚Â¦ÃƒÆ’Ã†â€™Ãƒâ€ Ã¢â‚¬â„¢ÃƒÆ’Ã‚Â¢ÃƒÂ¢Ã¢â‚¬Å¡Ã‚Â¬Ãƒâ€¦Ã‚Â¡ÃƒÆ’Ã†â€™ÃƒÂ¢Ã¢â€šÂ¬Ã…Â¡ÃƒÆ’Ã¢â‚¬Å¡Ãƒâ€šÃ‚Â¡ÃƒÆ’Ã†â€™Ãƒâ€ Ã¢â‚¬â„¢ÃƒÆ’Ã¢â‚¬Â ÃƒÂ¢Ã¢â€šÂ¬Ã¢â€žÂ¢ÃƒÆ’Ã†â€™ÃƒÂ¢Ã¢â€šÂ¬Ã‚Â ÃƒÆ’Ã‚Â¢ÃƒÂ¢Ã¢â‚¬Å¡Ã‚Â¬ÃƒÂ¢Ã¢â‚¬Å¾Ã‚Â¢ÃƒÆ’Ã†â€™Ãƒâ€ Ã¢â‚¬â„¢ÃƒÆ’Ã‚Â¢ÃƒÂ¢Ã¢â‚¬Å¡Ã‚Â¬Ãƒâ€šÃ‚Â ÃƒÆ’Ã†â€™Ãƒâ€šÃ‚Â¢ÃƒÆ’Ã‚Â¢ÃƒÂ¢Ã¢â€šÂ¬Ã…Â¡Ãƒâ€šÃ‚Â¬ÃƒÆ’Ã‚Â¢ÃƒÂ¢Ã¢â€šÂ¬Ã…Â¾Ãƒâ€šÃ‚Â¢ÃƒÆ’Ã†â€™Ãƒâ€ Ã¢â‚¬â„¢ÃƒÆ’Ã¢â‚¬Â ÃƒÂ¢Ã¢â€šÂ¬Ã¢â€žÂ¢ÃƒÆ’Ã†â€™ÃƒÂ¢Ã¢â€šÂ¬Ã…Â¡ÃƒÆ’Ã¢â‚¬Å¡Ãƒâ€šÃ‚Â¢ÃƒÆ’Ã†â€™Ãƒâ€ Ã¢â‚¬â„¢ÃƒÆ’Ã¢â‚¬Å¡Ãƒâ€šÃ‚Â¢ÃƒÆ’Ã†â€™Ãƒâ€šÃ‚Â¢ÃƒÆ’Ã‚Â¢ÃƒÂ¢Ã¢â€šÂ¬Ã…Â¡Ãƒâ€šÃ‚Â¬ÃƒÆ’Ã¢â‚¬Â¦Ãƒâ€šÃ‚Â¡ÃƒÆ’Ã†â€™ÃƒÂ¢Ã¢â€šÂ¬Ã…Â¡ÃƒÆ’Ã¢â‚¬Å¡Ãƒâ€šÃ‚Â¬ÃƒÆ’Ã†â€™Ãƒâ€ Ã¢â‚¬â„¢ÃƒÆ’Ã‚Â¢ÃƒÂ¢Ã¢â‚¬Å¡Ã‚Â¬Ãƒâ€šÃ‚Â¦ÃƒÆ’Ã†â€™ÃƒÂ¢Ã¢â€šÂ¬Ã…Â¡ÃƒÆ’Ã¢â‚¬Å¡Ãƒâ€šÃ‚Â¡ÃƒÆ’Ã†â€™Ãƒâ€ Ã¢â‚¬â„¢ÃƒÆ’Ã¢â‚¬Â ÃƒÂ¢Ã¢â€šÂ¬Ã¢â€žÂ¢ÃƒÆ’Ã†â€™ÃƒÂ¢Ã¢â€šÂ¬Ã‚Â ÃƒÆ’Ã‚Â¢ÃƒÂ¢Ã¢â‚¬Å¡Ã‚Â¬ÃƒÂ¢Ã¢â‚¬Å¾Ã‚Â¢ÃƒÆ’Ã†â€™Ãƒâ€ Ã¢â‚¬â„¢ÃƒÆ’Ã¢â‚¬Å¡Ãƒâ€šÃ‚Â¢ÃƒÆ’Ã†â€™Ãƒâ€šÃ‚Â¢ÃƒÆ’Ã‚Â¢ÃƒÂ¢Ã¢â‚¬Å¡Ã‚Â¬Ãƒâ€¦Ã‚Â¡ÃƒÆ’Ã¢â‚¬Å¡Ãƒâ€šÃ‚Â¬ÃƒÆ’Ã†â€™ÃƒÂ¢Ã¢â€šÂ¬Ã‚Â¦ÃƒÆ’Ã¢â‚¬Å¡Ãƒâ€šÃ‚Â¡ÃƒÆ’Ã†â€™Ãƒâ€ Ã¢â‚¬â„¢ÃƒÆ’Ã¢â‚¬Â ÃƒÂ¢Ã¢â€šÂ¬Ã¢â€žÂ¢ÃƒÆ’Ã†â€™Ãƒâ€šÃ‚Â¢ÃƒÆ’Ã‚Â¢ÃƒÂ¢Ã¢â€šÂ¬Ã…Â¡Ãƒâ€šÃ‚Â¬ÃƒÆ’Ã¢â‚¬Â¦Ãƒâ€šÃ‚Â¡ÃƒÆ’Ã†â€™Ãƒâ€ Ã¢â‚¬â„¢ÃƒÆ’Ã‚Â¢ÃƒÂ¢Ã¢â‚¬Å¡Ã‚Â¬Ãƒâ€¦Ã‚Â¡ÃƒÆ’Ã†â€™ÃƒÂ¢Ã¢â€šÂ¬Ã…Â¡ÃƒÆ’Ã¢â‚¬Å¡Ãƒâ€šÃ‚Â°C in both systems.</w:t>
       </w:r>
     </w:p>
     <w:p>
@@ -7018,7 +7018,7 @@
               <w:rPr>
                 <w:rFonts w:ascii="Times New Roman" w:hAnsi="Times New Roman" w:cs="Times New Roman"/>
               </w:rPr>
-              <w:t>pH (Mean ÃƒÆ’Ã†â€™Ãƒâ€ Ã¢â‚¬â„¢ÃƒÆ’Ã¢â‚¬Â ÃƒÂ¢Ã¢â€šÂ¬Ã¢â€žÂ¢ÃƒÆ’Ã†â€™ÃƒÂ¢Ã¢â€šÂ¬Ã‚Â ÃƒÆ’Ã‚Â¢ÃƒÂ¢Ã¢â‚¬Å¡Ã‚Â¬ÃƒÂ¢Ã¢â‚¬Å¾Ã‚Â¢ÃƒÆ’Ã†â€™Ãƒâ€ Ã¢â‚¬â„¢ÃƒÆ’Ã¢â‚¬Å¡Ãƒâ€šÃ‚Â¢ÃƒÆ’Ã†â€™Ãƒâ€šÃ‚Â¢ÃƒÆ’Ã‚Â¢ÃƒÂ¢Ã¢â‚¬Å¡Ã‚Â¬Ãƒâ€¦Ã‚Â¡ÃƒÆ’Ã¢â‚¬Å¡Ãƒâ€šÃ‚Â¬ÃƒÆ’Ã†â€™ÃƒÂ¢Ã¢â€šÂ¬Ã‚Â¦ÃƒÆ’Ã¢â‚¬Å¡Ãƒâ€šÃ‚Â¡ÃƒÆ’Ã†â€™Ãƒâ€ Ã¢â‚¬â„¢ÃƒÆ’Ã¢â‚¬Â ÃƒÂ¢Ã¢â€šÂ¬Ã¢â€žÂ¢ÃƒÆ’Ã†â€™Ãƒâ€šÃ‚Â¢ÃƒÆ’Ã‚Â¢ÃƒÂ¢Ã¢â€šÂ¬Ã…Â¡Ãƒâ€šÃ‚Â¬ÃƒÆ’Ã¢â‚¬Â¦Ãƒâ€šÃ‚Â¡ÃƒÆ’Ã†â€™Ãƒâ€ Ã¢â‚¬â„¢ÃƒÆ’Ã‚Â¢ÃƒÂ¢Ã¢â‚¬Å¡Ã‚Â¬Ãƒâ€¦Ã‚Â¡ÃƒÆ’Ã†â€™ÃƒÂ¢Ã¢â€šÂ¬Ã…Â¡ÃƒÆ’Ã¢â‚¬Å¡Ãƒâ€šÃ‚Â± SD)</w:t>
+              <w:t>pH (Mean ÃƒÆ’Ã†â€™Ãƒâ€ Ã¢â‚¬â„¢ÃƒÆ’Ã¢â‚¬Â ÃƒÂ¢Ã¢â€šÂ¬Ã¢â€žÂ¢ÃƒÆ’Ã†â€™ÃƒÂ¢Ã¢â€šÂ¬Ã‚Â ÃƒÆ’Ã‚Â¢ÃƒÂ¢Ã¢â‚¬Å¡Ã‚Â¬ÃƒÂ¢Ã¢â‚¬Å¾Ã‚Â¢ÃƒÆ’Ã†â€™Ãƒâ€ Ã¢â‚¬â„¢ÃƒÆ’Ã‚Â¢ÃƒÂ¢Ã¢â‚¬Å¡Ã‚Â¬Ãƒâ€šÃ‚Â ÃƒÆ’Ã†â€™Ãƒâ€šÃ‚Â¢ÃƒÆ’Ã‚Â¢ÃƒÂ¢Ã¢â€šÂ¬Ã…Â¡Ãƒâ€šÃ‚Â¬ÃƒÆ’Ã‚Â¢ÃƒÂ¢Ã¢â€šÂ¬Ã…Â¾Ãƒâ€šÃ‚Â¢ÃƒÆ’Ã†â€™Ãƒâ€ Ã¢â‚¬â„¢ÃƒÆ’Ã¢â‚¬Â ÃƒÂ¢Ã¢â€šÂ¬Ã¢â€žÂ¢ÃƒÆ’Ã†â€™Ãƒâ€šÃ‚Â¢ÃƒÆ’Ã‚Â¢ÃƒÂ¢Ã¢â€šÂ¬Ã…Â¡Ãƒâ€šÃ‚Â¬ÃƒÆ’Ã¢â‚¬Å¡Ãƒâ€šÃ‚Â ÃƒÆ’Ã†â€™Ãƒâ€ Ã¢â‚¬â„¢ÃƒÆ’Ã¢â‚¬Å¡Ãƒâ€šÃ‚Â¢ÃƒÆ’Ã†â€™Ãƒâ€šÃ‚Â¢ÃƒÆ’Ã‚Â¢ÃƒÂ¢Ã¢â‚¬Å¡Ã‚Â¬Ãƒâ€¦Ã‚Â¡ÃƒÆ’Ã¢â‚¬Å¡Ãƒâ€šÃ‚Â¬ÃƒÆ’Ã†â€™Ãƒâ€šÃ‚Â¢ÃƒÆ’Ã‚Â¢ÃƒÂ¢Ã¢â‚¬Å¡Ã‚Â¬Ãƒâ€¦Ã‚Â¾ÃƒÆ’Ã¢â‚¬Å¡Ãƒâ€šÃ‚Â¢ÃƒÆ’Ã†â€™Ãƒâ€ Ã¢â‚¬â„¢ÃƒÆ’Ã¢â‚¬Â ÃƒÂ¢Ã¢â€šÂ¬Ã¢â€žÂ¢ÃƒÆ’Ã†â€™ÃƒÂ¢Ã¢â€šÂ¬Ã‚Â ÃƒÆ’Ã‚Â¢ÃƒÂ¢Ã¢â‚¬Å¡Ã‚Â¬ÃƒÂ¢Ã¢â‚¬Å¾Ã‚Â¢ÃƒÆ’Ã†â€™Ãƒâ€ Ã¢â‚¬â„¢ÃƒÆ’Ã‚Â¢ÃƒÂ¢Ã¢â‚¬Å¡Ã‚Â¬Ãƒâ€¦Ã‚Â¡ÃƒÆ’Ã†â€™ÃƒÂ¢Ã¢â€šÂ¬Ã…Â¡ÃƒÆ’Ã¢â‚¬Å¡Ãƒâ€šÃ‚Â¢ÃƒÆ’Ã†â€™Ãƒâ€ Ã¢â‚¬â„¢ÃƒÆ’Ã¢â‚¬Â ÃƒÂ¢Ã¢â€šÂ¬Ã¢â€žÂ¢ÃƒÆ’Ã†â€™ÃƒÂ¢Ã¢â€šÂ¬Ã…Â¡ÃƒÆ’Ã¢â‚¬Å¡Ãƒâ€šÃ‚Â¢ÃƒÆ’Ã†â€™Ãƒâ€ Ã¢â‚¬â„¢ÃƒÆ’Ã¢â‚¬Å¡Ãƒâ€šÃ‚Â¢ÃƒÆ’Ã†â€™Ãƒâ€šÃ‚Â¢ÃƒÆ’Ã‚Â¢ÃƒÂ¢Ã¢â‚¬Å¡Ã‚Â¬Ãƒâ€¦Ã‚Â¡ÃƒÆ’Ã¢â‚¬Å¡Ãƒâ€šÃ‚Â¬ÃƒÆ’Ã†â€™ÃƒÂ¢Ã¢â€šÂ¬Ã‚Â¦ÃƒÆ’Ã¢â‚¬Å¡Ãƒâ€šÃ‚Â¡ÃƒÆ’Ã†â€™Ãƒâ€ Ã¢â‚¬â„¢ÃƒÆ’Ã‚Â¢ÃƒÂ¢Ã¢â‚¬Å¡Ã‚Â¬Ãƒâ€¦Ã‚Â¡ÃƒÆ’Ã†â€™ÃƒÂ¢Ã¢â€šÂ¬Ã…Â¡ÃƒÆ’Ã¢â‚¬Å¡Ãƒâ€šÃ‚Â¬ÃƒÆ’Ã†â€™Ãƒâ€ Ã¢â‚¬â„¢ÃƒÆ’Ã¢â‚¬Â ÃƒÂ¢Ã¢â€šÂ¬Ã¢â€žÂ¢ÃƒÆ’Ã†â€™Ãƒâ€šÃ‚Â¢ÃƒÆ’Ã‚Â¢ÃƒÂ¢Ã¢â€šÂ¬Ã…Â¡Ãƒâ€šÃ‚Â¬ÃƒÆ’Ã¢â‚¬Å¡Ãƒâ€šÃ‚Â¦ÃƒÆ’Ã†â€™Ãƒâ€ Ã¢â‚¬â„¢ÃƒÆ’Ã‚Â¢ÃƒÂ¢Ã¢â‚¬Å¡Ã‚Â¬Ãƒâ€¦Ã‚Â¡ÃƒÆ’Ã†â€™ÃƒÂ¢Ã¢â€šÂ¬Ã…Â¡ÃƒÆ’Ã¢â‚¬Å¡Ãƒâ€šÃ‚Â¡ÃƒÆ’Ã†â€™Ãƒâ€ Ã¢â‚¬â„¢ÃƒÆ’Ã¢â‚¬Â ÃƒÂ¢Ã¢â€šÂ¬Ã¢â€žÂ¢ÃƒÆ’Ã†â€™ÃƒÂ¢Ã¢â€šÂ¬Ã‚Â ÃƒÆ’Ã‚Â¢ÃƒÂ¢Ã¢â‚¬Å¡Ã‚Â¬ÃƒÂ¢Ã¢â‚¬Å¾Ã‚Â¢ÃƒÆ’Ã†â€™Ãƒâ€ Ã¢â‚¬â„¢ÃƒÆ’Ã‚Â¢ÃƒÂ¢Ã¢â‚¬Å¡Ã‚Â¬Ãƒâ€šÃ‚Â ÃƒÆ’Ã†â€™Ãƒâ€šÃ‚Â¢ÃƒÆ’Ã‚Â¢ÃƒÂ¢Ã¢â€šÂ¬Ã…Â¡Ãƒâ€šÃ‚Â¬ÃƒÆ’Ã‚Â¢ÃƒÂ¢Ã¢â€šÂ¬Ã…Â¾Ãƒâ€šÃ‚Â¢ÃƒÆ’Ã†â€™Ãƒâ€ Ã¢â‚¬â„¢ÃƒÆ’Ã¢â‚¬Â ÃƒÂ¢Ã¢â€šÂ¬Ã¢â€žÂ¢ÃƒÆ’Ã†â€™ÃƒÂ¢Ã¢â€šÂ¬Ã…Â¡ÃƒÆ’Ã¢â‚¬Å¡Ãƒâ€šÃ‚Â¢ÃƒÆ’Ã†â€™Ãƒâ€ Ã¢â‚¬â„¢ÃƒÆ’Ã¢â‚¬Å¡Ãƒâ€šÃ‚Â¢ÃƒÆ’Ã†â€™Ãƒâ€šÃ‚Â¢ÃƒÆ’Ã‚Â¢ÃƒÂ¢Ã¢â€šÂ¬Ã…Â¡Ãƒâ€šÃ‚Â¬ÃƒÆ’Ã¢â‚¬Â¦Ãƒâ€šÃ‚Â¡ÃƒÆ’Ã†â€™ÃƒÂ¢Ã¢â€šÂ¬Ã…Â¡ÃƒÆ’Ã¢â‚¬Å¡Ãƒâ€šÃ‚Â¬ÃƒÆ’Ã†â€™Ãƒâ€ Ã¢â‚¬â„¢ÃƒÆ’Ã‚Â¢ÃƒÂ¢Ã¢â‚¬Å¡Ã‚Â¬Ãƒâ€šÃ‚Â¦ÃƒÆ’Ã†â€™ÃƒÂ¢Ã¢â€šÂ¬Ã…Â¡ÃƒÆ’Ã¢â‚¬Å¡Ãƒâ€šÃ‚Â¡ÃƒÆ’Ã†â€™Ãƒâ€ Ã¢â‚¬â„¢ÃƒÆ’Ã¢â‚¬Â ÃƒÂ¢Ã¢â€šÂ¬Ã¢â€žÂ¢ÃƒÆ’Ã†â€™ÃƒÂ¢Ã¢â€šÂ¬Ã‚Â ÃƒÆ’Ã‚Â¢ÃƒÂ¢Ã¢â‚¬Å¡Ã‚Â¬ÃƒÂ¢Ã¢â‚¬Å¾Ã‚Â¢ÃƒÆ’Ã†â€™Ãƒâ€ Ã¢â‚¬â„¢ÃƒÆ’Ã¢â‚¬Å¡Ãƒâ€šÃ‚Â¢ÃƒÆ’Ã†â€™Ãƒâ€šÃ‚Â¢ÃƒÆ’Ã‚Â¢ÃƒÂ¢Ã¢â‚¬Å¡Ã‚Â¬Ãƒâ€¦Ã‚Â¡ÃƒÆ’Ã¢â‚¬Å¡Ãƒâ€šÃ‚Â¬ÃƒÆ’Ã†â€™ÃƒÂ¢Ã¢â€šÂ¬Ã‚Â¦ÃƒÆ’Ã¢â‚¬Å¡Ãƒâ€šÃ‚Â¡ÃƒÆ’Ã†â€™Ãƒâ€ Ã¢â‚¬â„¢ÃƒÆ’Ã¢â‚¬Â ÃƒÂ¢Ã¢â€šÂ¬Ã¢â€žÂ¢ÃƒÆ’Ã†â€™Ãƒâ€šÃ‚Â¢ÃƒÆ’Ã‚Â¢ÃƒÂ¢Ã¢â€šÂ¬Ã…Â¡Ãƒâ€šÃ‚Â¬ÃƒÆ’Ã¢â‚¬Â¦Ãƒâ€šÃ‚Â¡ÃƒÆ’Ã†â€™Ãƒâ€ Ã¢â‚¬â„¢ÃƒÆ’Ã‚Â¢ÃƒÂ¢Ã¢â‚¬Å¡Ã‚Â¬Ãƒâ€¦Ã‚Â¡ÃƒÆ’Ã†â€™ÃƒÂ¢Ã¢â€šÂ¬Ã…Â¡ÃƒÆ’Ã¢â‚¬Å¡Ãƒâ€šÃ‚Â± SD)</w:t>
             </w:r>
           </w:p>
         </w:tc>
@@ -7075,7 +7075,7 @@
               <w:rPr>
                 <w:rFonts w:ascii="Times New Roman" w:hAnsi="Times New Roman" w:cs="Times New Roman"/>
               </w:rPr>
-              <w:t>Temperature (ÃƒÆ’Ã†â€™Ãƒâ€ Ã¢â‚¬â„¢ÃƒÆ’Ã¢â‚¬Â ÃƒÂ¢Ã¢â€šÂ¬Ã¢â€žÂ¢ÃƒÆ’Ã†â€™ÃƒÂ¢Ã¢â€šÂ¬Ã‚Â ÃƒÆ’Ã‚Â¢ÃƒÂ¢Ã¢â‚¬Å¡Ã‚Â¬ÃƒÂ¢Ã¢â‚¬Å¾Ã‚Â¢ÃƒÆ’Ã†â€™Ãƒâ€ Ã¢â‚¬â„¢ÃƒÆ’Ã¢â‚¬Å¡Ãƒâ€šÃ‚Â¢ÃƒÆ’Ã†â€™Ãƒâ€šÃ‚Â¢ÃƒÆ’Ã‚Â¢ÃƒÂ¢Ã¢â‚¬Å¡Ã‚Â¬Ãƒâ€¦Ã‚Â¡ÃƒÆ’Ã¢â‚¬Å¡Ãƒâ€šÃ‚Â¬ÃƒÆ’Ã†â€™ÃƒÂ¢Ã¢â€šÂ¬Ã‚Â¦ÃƒÆ’Ã¢â‚¬Å¡Ãƒâ€šÃ‚Â¡ÃƒÆ’Ã†â€™Ãƒâ€ Ã¢â‚¬â„¢ÃƒÆ’Ã¢â‚¬Â ÃƒÂ¢Ã¢â€šÂ¬Ã¢â€žÂ¢ÃƒÆ’Ã†â€™Ãƒâ€šÃ‚Â¢ÃƒÆ’Ã‚Â¢ÃƒÂ¢Ã¢â€šÂ¬Ã…Â¡Ãƒâ€šÃ‚Â¬ÃƒÆ’Ã¢â‚¬Â¦Ãƒâ€šÃ‚Â¡ÃƒÆ’Ã†â€™Ãƒâ€ Ã¢â‚¬â„¢ÃƒÆ’Ã‚Â¢ÃƒÂ¢Ã¢â‚¬Å¡Ã‚Â¬Ãƒâ€¦Ã‚Â¡ÃƒÆ’Ã†â€™ÃƒÂ¢Ã¢â€šÂ¬Ã…Â¡ÃƒÆ’Ã¢â‚¬Å¡Ãƒâ€šÃ‚Â°C)</w:t>
+              <w:t>Temperature (ÃƒÆ’Ã†â€™Ãƒâ€ Ã¢â‚¬â„¢ÃƒÆ’Ã¢â‚¬Â ÃƒÂ¢Ã¢â€šÂ¬Ã¢â€žÂ¢ÃƒÆ’Ã†â€™ÃƒÂ¢Ã¢â€šÂ¬Ã‚Â ÃƒÆ’Ã‚Â¢ÃƒÂ¢Ã¢â‚¬Å¡Ã‚Â¬ÃƒÂ¢Ã¢â‚¬Å¾Ã‚Â¢ÃƒÆ’Ã†â€™Ãƒâ€ Ã¢â‚¬â„¢ÃƒÆ’Ã‚Â¢ÃƒÂ¢Ã¢â‚¬Å¡Ã‚Â¬Ãƒâ€šÃ‚Â ÃƒÆ’Ã†â€™Ãƒâ€šÃ‚Â¢ÃƒÆ’Ã‚Â¢ÃƒÂ¢Ã¢â€šÂ¬Ã…Â¡Ãƒâ€šÃ‚Â¬ÃƒÆ’Ã‚Â¢ÃƒÂ¢Ã¢â€šÂ¬Ã…Â¾Ãƒâ€šÃ‚Â¢ÃƒÆ’Ã†â€™Ãƒâ€ Ã¢â‚¬â„¢ÃƒÆ’Ã¢â‚¬Â ÃƒÂ¢Ã¢â€šÂ¬Ã¢â€žÂ¢ÃƒÆ’Ã†â€™Ãƒâ€šÃ‚Â¢ÃƒÆ’Ã‚Â¢ÃƒÂ¢Ã¢â€šÂ¬Ã…Â¡Ãƒâ€šÃ‚Â¬ÃƒÆ’Ã¢â‚¬Å¡Ãƒâ€šÃ‚Â ÃƒÆ’Ã†â€™Ãƒâ€ Ã¢â‚¬â„¢ÃƒÆ’Ã¢â‚¬Å¡Ãƒâ€šÃ‚Â¢ÃƒÆ’Ã†â€™Ãƒâ€šÃ‚Â¢ÃƒÆ’Ã‚Â¢ÃƒÂ¢Ã¢â‚¬Å¡Ã‚Â¬Ãƒâ€¦Ã‚Â¡ÃƒÆ’Ã¢â‚¬Å¡Ãƒâ€šÃ‚Â¬ÃƒÆ’Ã†â€™Ãƒâ€šÃ‚Â¢ÃƒÆ’Ã‚Â¢ÃƒÂ¢Ã¢â‚¬Å¡Ã‚Â¬Ãƒâ€¦Ã‚Â¾ÃƒÆ’Ã¢â‚¬Å¡Ãƒâ€šÃ‚Â¢ÃƒÆ’Ã†â€™Ãƒâ€ Ã¢â‚¬â„¢ÃƒÆ’Ã¢â‚¬Â ÃƒÂ¢Ã¢â€šÂ¬Ã¢â€žÂ¢ÃƒÆ’Ã†â€™ÃƒÂ¢Ã¢â€šÂ¬Ã‚Â ÃƒÆ’Ã‚Â¢ÃƒÂ¢Ã¢â‚¬Å¡Ã‚Â¬ÃƒÂ¢Ã¢â‚¬Å¾Ã‚Â¢ÃƒÆ’Ã†â€™Ãƒâ€ Ã¢â‚¬â„¢ÃƒÆ’Ã‚Â¢ÃƒÂ¢Ã¢â‚¬Å¡Ã‚Â¬Ãƒâ€¦Ã‚Â¡ÃƒÆ’Ã†â€™ÃƒÂ¢Ã¢â€šÂ¬Ã…Â¡ÃƒÆ’Ã¢â‚¬Å¡Ãƒâ€šÃ‚Â¢ÃƒÆ’Ã†â€™Ãƒâ€ Ã¢â‚¬â„¢ÃƒÆ’Ã¢â‚¬Â ÃƒÂ¢Ã¢â€šÂ¬Ã¢â€žÂ¢ÃƒÆ’Ã†â€™ÃƒÂ¢Ã¢â€šÂ¬Ã…Â¡ÃƒÆ’Ã¢â‚¬Å¡Ãƒâ€šÃ‚Â¢ÃƒÆ’Ã†â€™Ãƒâ€ Ã¢â‚¬â„¢ÃƒÆ’Ã¢â‚¬Å¡Ãƒâ€šÃ‚Â¢ÃƒÆ’Ã†â€™Ãƒâ€šÃ‚Â¢ÃƒÆ’Ã‚Â¢ÃƒÂ¢Ã¢â‚¬Å¡Ã‚Â¬Ãƒâ€¦Ã‚Â¡ÃƒÆ’Ã¢â‚¬Å¡Ãƒâ€šÃ‚Â¬ÃƒÆ’Ã†â€™ÃƒÂ¢Ã¢â€šÂ¬Ã‚Â¦ÃƒÆ’Ã¢â‚¬Å¡Ãƒâ€šÃ‚Â¡ÃƒÆ’Ã†â€™Ãƒâ€ Ã¢â‚¬â„¢ÃƒÆ’Ã‚Â¢ÃƒÂ¢Ã¢â‚¬Å¡Ã‚Â¬Ãƒâ€¦Ã‚Â¡ÃƒÆ’Ã†â€™ÃƒÂ¢Ã¢â€šÂ¬Ã…Â¡ÃƒÆ’Ã¢â‚¬Å¡Ãƒâ€šÃ‚Â¬ÃƒÆ’Ã†â€™Ãƒâ€ Ã¢â‚¬â„¢ÃƒÆ’Ã¢â‚¬Â ÃƒÂ¢Ã¢â€šÂ¬Ã¢â€žÂ¢ÃƒÆ’Ã†â€™Ãƒâ€šÃ‚Â¢ÃƒÆ’Ã‚Â¢ÃƒÂ¢Ã¢â€šÂ¬Ã…Â¡Ãƒâ€šÃ‚Â¬ÃƒÆ’Ã¢â‚¬Å¡Ãƒâ€šÃ‚Â¦ÃƒÆ’Ã†â€™Ãƒâ€ Ã¢â‚¬â„¢ÃƒÆ’Ã‚Â¢ÃƒÂ¢Ã¢â‚¬Å¡Ã‚Â¬Ãƒâ€¦Ã‚Â¡ÃƒÆ’Ã†â€™ÃƒÂ¢Ã¢â€šÂ¬Ã…Â¡ÃƒÆ’Ã¢â‚¬Å¡Ãƒâ€šÃ‚Â¡ÃƒÆ’Ã†â€™Ãƒâ€ Ã¢â‚¬â„¢ÃƒÆ’Ã¢â‚¬Â ÃƒÂ¢Ã¢â€šÂ¬Ã¢â€žÂ¢ÃƒÆ’Ã†â€™ÃƒÂ¢Ã¢â€šÂ¬Ã‚Â ÃƒÆ’Ã‚Â¢ÃƒÂ¢Ã¢â‚¬Å¡Ã‚Â¬ÃƒÂ¢Ã¢â‚¬Å¾Ã‚Â¢ÃƒÆ’Ã†â€™Ãƒâ€ Ã¢â‚¬â„¢ÃƒÆ’Ã‚Â¢ÃƒÂ¢Ã¢â‚¬Å¡Ã‚Â¬Ãƒâ€šÃ‚Â ÃƒÆ’Ã†â€™Ãƒâ€šÃ‚Â¢ÃƒÆ’Ã‚Â¢ÃƒÂ¢Ã¢â€šÂ¬Ã…Â¡Ãƒâ€šÃ‚Â¬ÃƒÆ’Ã‚Â¢ÃƒÂ¢Ã¢â€šÂ¬Ã…Â¾Ãƒâ€šÃ‚Â¢ÃƒÆ’Ã†â€™Ãƒâ€ Ã¢â‚¬â„¢ÃƒÆ’Ã¢â‚¬Â ÃƒÂ¢Ã¢â€šÂ¬Ã¢â€žÂ¢ÃƒÆ’Ã†â€™ÃƒÂ¢Ã¢â€šÂ¬Ã…Â¡ÃƒÆ’Ã¢â‚¬Å¡Ãƒâ€šÃ‚Â¢ÃƒÆ’Ã†â€™Ãƒâ€ Ã¢â‚¬â„¢ÃƒÆ’Ã¢â‚¬Å¡Ãƒâ€šÃ‚Â¢ÃƒÆ’Ã†â€™Ãƒâ€šÃ‚Â¢ÃƒÆ’Ã‚Â¢ÃƒÂ¢Ã¢â€šÂ¬Ã…Â¡Ãƒâ€šÃ‚Â¬ÃƒÆ’Ã¢â‚¬Â¦Ãƒâ€šÃ‚Â¡ÃƒÆ’Ã†â€™ÃƒÂ¢Ã¢â€šÂ¬Ã…Â¡ÃƒÆ’Ã¢â‚¬Å¡Ãƒâ€šÃ‚Â¬ÃƒÆ’Ã†â€™Ãƒâ€ Ã¢â‚¬â„¢ÃƒÆ’Ã‚Â¢ÃƒÂ¢Ã¢â‚¬Å¡Ã‚Â¬Ãƒâ€šÃ‚Â¦ÃƒÆ’Ã†â€™ÃƒÂ¢Ã¢â€šÂ¬Ã…Â¡ÃƒÆ’Ã¢â‚¬Å¡Ãƒâ€šÃ‚Â¡ÃƒÆ’Ã†â€™Ãƒâ€ Ã¢â‚¬â„¢ÃƒÆ’Ã¢â‚¬Â ÃƒÂ¢Ã¢â€šÂ¬Ã¢â€žÂ¢ÃƒÆ’Ã†â€™ÃƒÂ¢Ã¢â€šÂ¬Ã‚Â ÃƒÆ’Ã‚Â¢ÃƒÂ¢Ã¢â‚¬Å¡Ã‚Â¬ÃƒÂ¢Ã¢â‚¬Å¾Ã‚Â¢ÃƒÆ’Ã†â€™Ãƒâ€ Ã¢â‚¬â„¢ÃƒÆ’Ã¢â‚¬Å¡Ãƒâ€šÃ‚Â¢ÃƒÆ’Ã†â€™Ãƒâ€šÃ‚Â¢ÃƒÆ’Ã‚Â¢ÃƒÂ¢Ã¢â‚¬Å¡Ã‚Â¬Ãƒâ€¦Ã‚Â¡ÃƒÆ’Ã¢â‚¬Å¡Ãƒâ€šÃ‚Â¬ÃƒÆ’Ã†â€™ÃƒÂ¢Ã¢â€šÂ¬Ã‚Â¦ÃƒÆ’Ã¢â‚¬Å¡Ãƒâ€šÃ‚Â¡ÃƒÆ’Ã†â€™Ãƒâ€ Ã¢â‚¬â„¢ÃƒÆ’Ã¢â‚¬Â ÃƒÂ¢Ã¢â€šÂ¬Ã¢â€žÂ¢ÃƒÆ’Ã†â€™Ãƒâ€šÃ‚Â¢ÃƒÆ’Ã‚Â¢ÃƒÂ¢Ã¢â€šÂ¬Ã…Â¡Ãƒâ€šÃ‚Â¬ÃƒÆ’Ã¢â‚¬Â¦Ãƒâ€šÃ‚Â¡ÃƒÆ’Ã†â€™Ãƒâ€ Ã¢â‚¬â„¢ÃƒÆ’Ã‚Â¢ÃƒÂ¢Ã¢â‚¬Å¡Ã‚Â¬Ãƒâ€¦Ã‚Â¡ÃƒÆ’Ã†â€™ÃƒÂ¢Ã¢â€šÂ¬Ã…Â¡ÃƒÆ’Ã¢â‚¬Å¡Ãƒâ€šÃ‚Â°C)</w:t>
             </w:r>
           </w:p>
         </w:tc>
@@ -8016,7 +8016,7 @@
         <w:rPr>
           <w:rFonts w:ascii="Times New Roman" w:hAnsi="Times New Roman" w:cs="Times New Roman"/>
         </w:rPr>
-        <w:t>-chemical water quality parameters for IMTA (Integrated Multi-Trophic Aquaculture) and Monoculture treatments over a seven-week experimental period. Overall, both systems exhibited similar temporal patterns in temperature and pH, indicating that basic physical parameters followed the same environmental fluctuations in both treatments. Water temperature in both systems showed a declining trend from approximately 28ÃƒÆ’Ã†â€™Ãƒâ€ Ã¢â‚¬â„¢ÃƒÆ’Ã¢â‚¬Â ÃƒÂ¢Ã¢â€šÂ¬Ã¢â€žÂ¢ÃƒÆ’Ã†â€™ÃƒÂ¢Ã¢â€šÂ¬Ã‚Â ÃƒÆ’Ã‚Â¢ÃƒÂ¢Ã¢â‚¬Å¡Ã‚Â¬ÃƒÂ¢Ã¢â‚¬Å¾Ã‚Â¢ÃƒÆ’Ã†â€™Ãƒâ€ Ã¢â‚¬â„¢ÃƒÆ’Ã¢â‚¬Å¡Ãƒâ€šÃ‚Â¢ÃƒÆ’Ã†â€™Ãƒâ€šÃ‚Â¢ÃƒÆ’Ã‚Â¢ÃƒÂ¢Ã¢â‚¬Å¡Ã‚Â¬Ãƒâ€¦Ã‚Â¡ÃƒÆ’Ã¢â‚¬Å¡Ãƒâ€šÃ‚Â¬ÃƒÆ’Ã†â€™ÃƒÂ¢Ã¢â€šÂ¬Ã‚Â¦ÃƒÆ’Ã¢â‚¬Å¡Ãƒâ€šÃ‚Â¡ÃƒÆ’Ã†â€™Ãƒâ€ Ã¢â‚¬â„¢ÃƒÆ’Ã¢â‚¬Â ÃƒÂ¢Ã¢â€šÂ¬Ã¢â€žÂ¢ÃƒÆ’Ã†â€™Ãƒâ€šÃ‚Â¢ÃƒÆ’Ã‚Â¢ÃƒÂ¢Ã¢â€šÂ¬Ã…Â¡Ãƒâ€šÃ‚Â¬ÃƒÆ’Ã¢â‚¬Â¦Ãƒâ€šÃ‚Â¡ÃƒÆ’Ã†â€™Ãƒâ€ Ã¢â‚¬â„¢ÃƒÆ’Ã‚Â¢ÃƒÂ¢Ã¢â‚¬Å¡Ã‚Â¬Ãƒâ€¦Ã‚Â¡ÃƒÆ’Ã†â€™ÃƒÂ¢Ã¢â€šÂ¬Ã…Â¡ÃƒÆ’Ã¢â‚¬Å¡Ãƒâ€šÃ‚Â°C at the beginning to a minimum of around 25.6ÃƒÆ’Ã†â€™Ãƒâ€ Ã¢â‚¬â„¢ÃƒÆ’Ã¢â‚¬Â ÃƒÂ¢Ã¢â€šÂ¬Ã¢â€žÂ¢ÃƒÆ’Ã†â€™ÃƒÂ¢Ã¢â€šÂ¬Ã‚Â ÃƒÆ’Ã‚Â¢ÃƒÂ¢Ã¢â‚¬Å¡Ã‚Â¬ÃƒÂ¢Ã¢â‚¬Å¾Ã‚Â¢ÃƒÆ’Ã†â€™Ãƒâ€ Ã¢â‚¬â„¢ÃƒÆ’Ã‚Â¢ÃƒÂ¢Ã¢â‚¬Å¡Ã‚Â¬Ãƒâ€¦Ã‚Â¡ÃƒÆ’Ã†â€™ÃƒÂ¢Ã¢â€šÂ¬Ã…Â¡ÃƒÆ’Ã¢â‚¬Å¡Ãƒâ€šÃ‚Â¢ÃƒÆ’Ã†â€™Ãƒâ€ Ã¢â‚¬â„¢ÃƒÆ’Ã¢â‚¬Â ÃƒÂ¢Ã¢â€šÂ¬Ã¢â€žÂ¢ÃƒÆ’Ã†â€™ÃƒÂ¢Ã¢â€šÂ¬Ã…Â¡ÃƒÆ’Ã¢â‚¬Å¡Ãƒâ€šÃ‚Â¢ÃƒÆ’Ã†â€™Ãƒâ€ Ã¢â‚¬â„¢ÃƒÆ’Ã¢â‚¬Å¡Ãƒâ€šÃ‚Â¢ÃƒÆ’Ã†â€™Ãƒâ€šÃ‚Â¢ÃƒÆ’Ã‚Â¢ÃƒÂ¢Ã¢â‚¬Å¡Ã‚Â¬Ãƒâ€¦Ã‚Â¡ÃƒÆ’Ã¢â‚¬Å¡Ãƒâ€šÃ‚Â¬ÃƒÆ’Ã†â€™ÃƒÂ¢Ã¢â€šÂ¬Ã‚Â¦ÃƒÆ’Ã¢â‚¬Å¡Ãƒâ€šÃ‚Â¡ÃƒÆ’Ã†â€™Ãƒâ€ Ã¢â‚¬â„¢ÃƒÆ’Ã‚Â¢ÃƒÂ¢Ã¢â‚¬Å¡Ã‚Â¬Ãƒâ€¦Ã‚Â¡ÃƒÆ’Ã†â€™ÃƒÂ¢Ã¢â€šÂ¬Ã…Â¡ÃƒÆ’Ã¢â‚¬Å¡Ãƒâ€šÃ‚Â¬ÃƒÆ’Ã†â€™Ãƒâ€ Ã¢â‚¬â„¢ÃƒÆ’Ã¢â‚¬Â ÃƒÂ¢Ã¢â€šÂ¬Ã¢â€žÂ¢ÃƒÆ’Ã†â€™ÃƒÂ¢Ã¢â€šÂ¬Ã…Â¡ÃƒÆ’Ã¢â‚¬Å¡Ãƒâ€šÃ‚Â¢ÃƒÆ’Ã†â€™Ãƒâ€ Ã¢â‚¬â„¢ÃƒÆ’Ã¢â‚¬Å¡Ãƒâ€šÃ‚Â¢ÃƒÆ’Ã†â€™Ãƒâ€šÃ‚Â¢ÃƒÆ’Ã‚Â¢ÃƒÂ¢Ã¢â€šÂ¬Ã…Â¡Ãƒâ€šÃ‚Â¬ÃƒÆ’Ã¢â‚¬Â¦Ãƒâ€šÃ‚Â¡ÃƒÆ’Ã†â€™ÃƒÂ¢Ã¢â€šÂ¬Ã…Â¡ÃƒÆ’Ã¢â‚¬Å¡Ãƒâ€šÃ‚Â¬ÃƒÆ’Ã†â€™Ãƒâ€ Ã¢â‚¬â„¢ÃƒÆ’Ã‚Â¢ÃƒÂ¢Ã¢â‚¬Å¡Ã‚Â¬Ãƒâ€šÃ‚Â¦ÃƒÆ’Ã†â€™Ãƒâ€šÃ‚Â¢ÃƒÆ’Ã‚Â¢ÃƒÂ¢Ã¢â€šÂ¬Ã…Â¡Ãƒâ€šÃ‚Â¬ÃƒÆ’Ã¢â‚¬Â¦ÃƒÂ¢Ã¢â€šÂ¬Ã…â€œ25.9ÃƒÆ’Ã†â€™Ãƒâ€ Ã¢â‚¬â„¢ÃƒÆ’Ã¢â‚¬Â ÃƒÂ¢Ã¢â€šÂ¬Ã¢â€žÂ¢ÃƒÆ’Ã†â€™ÃƒÂ¢Ã¢â€šÂ¬Ã‚Â ÃƒÆ’Ã‚Â¢ÃƒÂ¢Ã¢â‚¬Å¡Ã‚Â¬ÃƒÂ¢Ã¢â‚¬Å¾Ã‚Â¢ÃƒÆ’Ã†â€™Ãƒâ€ Ã¢â‚¬â„¢ÃƒÆ’Ã¢â‚¬Å¡Ãƒâ€šÃ‚Â¢ÃƒÆ’Ã†â€™Ãƒâ€šÃ‚Â¢ÃƒÆ’Ã‚Â¢ÃƒÂ¢Ã¢â‚¬Å¡Ã‚Â¬Ãƒâ€¦Ã‚Â¡ÃƒÆ’Ã¢â‚¬Å¡Ãƒâ€šÃ‚Â¬ÃƒÆ’Ã†â€™ÃƒÂ¢Ã¢â€šÂ¬Ã‚Â¦ÃƒÆ’Ã¢â‚¬Å¡Ãƒâ€šÃ‚Â¡ÃƒÆ’Ã†â€™Ãƒâ€ Ã¢â‚¬â„¢ÃƒÆ’Ã¢â‚¬Â ÃƒÂ¢Ã¢â€šÂ¬Ã¢â€žÂ¢ÃƒÆ’Ã†â€™Ãƒâ€šÃ‚Â¢ÃƒÆ’Ã‚Â¢ÃƒÂ¢Ã¢â€šÂ¬Ã…Â¡Ãƒâ€šÃ‚Â¬ÃƒÆ’Ã¢â‚¬Â¦Ãƒâ€šÃ‚Â¡ÃƒÆ’Ã†â€™Ãƒâ€ Ã¢â‚¬â„¢ÃƒÆ’Ã‚Â¢ÃƒÂ¢Ã¢â‚¬Å¡Ã‚Â¬Ãƒâ€¦Ã‚Â¡ÃƒÆ’Ã†â€™ÃƒÂ¢Ã¢â€šÂ¬Ã…Â¡ÃƒÆ’Ã¢â‚¬Å¡Ãƒâ€šÃ‚Â°C in Week 4, before recovering and stabilizing at about 28.1ÃƒÆ’Ã†â€™Ãƒâ€ Ã¢â‚¬â„¢ÃƒÆ’Ã¢â‚¬Â ÃƒÂ¢Ã¢â€šÂ¬Ã¢â€žÂ¢ÃƒÆ’Ã†â€™ÃƒÂ¢Ã¢â€šÂ¬Ã‚Â ÃƒÆ’Ã‚Â¢ÃƒÂ¢Ã¢â‚¬Å¡Ã‚Â¬ÃƒÂ¢Ã¢â‚¬Å¾Ã‚Â¢ÃƒÆ’Ã†â€™Ãƒâ€ Ã¢â‚¬â„¢ÃƒÆ’Ã¢â‚¬Å¡Ãƒâ€šÃ‚Â¢ÃƒÆ’Ã†â€™Ãƒâ€šÃ‚Â¢ÃƒÆ’Ã‚Â¢ÃƒÂ¢Ã¢â‚¬Å¡Ã‚Â¬Ãƒâ€¦Ã‚Â¡ÃƒÆ’Ã¢â‚¬Å¡Ãƒâ€šÃ‚Â¬ÃƒÆ’Ã†â€™ÃƒÂ¢Ã¢â€šÂ¬Ã‚Â¦ÃƒÆ’Ã¢â‚¬Å¡Ãƒâ€šÃ‚Â¡ÃƒÆ’Ã†â€™Ãƒâ€ Ã¢â‚¬â„¢ÃƒÆ’Ã¢â‚¬Â ÃƒÂ¢Ã¢â€šÂ¬Ã¢â€žÂ¢ÃƒÆ’Ã†â€™Ãƒâ€šÃ‚Â¢ÃƒÆ’Ã‚Â¢ÃƒÂ¢Ã¢â€šÂ¬Ã…Â¡Ãƒâ€šÃ‚Â¬ÃƒÆ’Ã¢â‚¬Â¦Ãƒâ€šÃ‚Â¡ÃƒÆ’Ã†â€™Ãƒâ€ Ã¢â‚¬â„¢ÃƒÆ’Ã‚Â¢ÃƒÂ¢Ã¢â‚¬Å¡Ã‚Â¬Ãƒâ€¦Ã‚Â¡ÃƒÆ’Ã†â€™ÃƒÂ¢Ã¢â€šÂ¬Ã…Â¡ÃƒÆ’Ã¢â‚¬Å¡Ãƒâ€šÃ‚Â°C by Week 7. Similarly, pH remained consistently alkaline throughout the study, with both treatments peaking in Week 4 (IMTA: 8.35; Monoculture: 8.37) and then gradually declining and stabilizing. From Week 3 onward, the IMTA system generally maintained slightly lower pH values compared to the Monoculture system.</w:t>
+        <w:t>-chemical water quality parameters for IMTA (Integrated Multi-Trophic Aquaculture) and Monoculture treatments over a seven-week experimental period. Overall, both systems exhibited similar temporal patterns in temperature and pH, indicating that basic physical parameters followed the same environmental fluctuations in both treatments. Water temperature in both systems showed a declining trend from approximately 28ÃƒÆ’Ã†â€™Ãƒâ€ Ã¢â‚¬â„¢ÃƒÆ’Ã¢â‚¬Â ÃƒÂ¢Ã¢â€šÂ¬Ã¢â€žÂ¢ÃƒÆ’Ã†â€™ÃƒÂ¢Ã¢â€šÂ¬Ã‚Â ÃƒÆ’Ã‚Â¢ÃƒÂ¢Ã¢â‚¬Å¡Ã‚Â¬ÃƒÂ¢Ã¢â‚¬Å¾Ã‚Â¢ÃƒÆ’Ã†â€™Ãƒâ€ Ã¢â‚¬â„¢ÃƒÆ’Ã‚Â¢ÃƒÂ¢Ã¢â‚¬Å¡Ã‚Â¬Ãƒâ€šÃ‚Â ÃƒÆ’Ã†â€™Ãƒâ€šÃ‚Â¢ÃƒÆ’Ã‚Â¢ÃƒÂ¢Ã¢â€šÂ¬Ã…Â¡Ãƒâ€šÃ‚Â¬ÃƒÆ’Ã‚Â¢ÃƒÂ¢Ã¢â€šÂ¬Ã…Â¾Ãƒâ€šÃ‚Â¢ÃƒÆ’Ã†â€™Ãƒâ€ Ã¢â‚¬â„¢ÃƒÆ’Ã¢â‚¬Â ÃƒÂ¢Ã¢â€šÂ¬Ã¢â€žÂ¢ÃƒÆ’Ã†â€™Ãƒâ€šÃ‚Â¢ÃƒÆ’Ã‚Â¢ÃƒÂ¢Ã¢â€šÂ¬Ã…Â¡Ãƒâ€šÃ‚Â¬ÃƒÆ’Ã¢â‚¬Å¡Ãƒâ€šÃ‚Â ÃƒÆ’Ã†â€™Ãƒâ€ Ã¢â‚¬â„¢ÃƒÆ’Ã¢â‚¬Å¡Ãƒâ€šÃ‚Â¢ÃƒÆ’Ã†â€™Ãƒâ€šÃ‚Â¢ÃƒÆ’Ã‚Â¢ÃƒÂ¢Ã¢â‚¬Å¡Ã‚Â¬Ãƒâ€¦Ã‚Â¡ÃƒÆ’Ã¢â‚¬Å¡Ãƒâ€šÃ‚Â¬ÃƒÆ’Ã†â€™Ãƒâ€šÃ‚Â¢ÃƒÆ’Ã‚Â¢ÃƒÂ¢Ã¢â‚¬Å¡Ã‚Â¬Ãƒâ€¦Ã‚Â¾ÃƒÆ’Ã¢â‚¬Å¡Ãƒâ€šÃ‚Â¢ÃƒÆ’Ã†â€™Ãƒâ€ Ã¢â‚¬â„¢ÃƒÆ’Ã¢â‚¬Â ÃƒÂ¢Ã¢â€šÂ¬Ã¢â€žÂ¢ÃƒÆ’Ã†â€™ÃƒÂ¢Ã¢â€šÂ¬Ã‚Â ÃƒÆ’Ã‚Â¢ÃƒÂ¢Ã¢â‚¬Å¡Ã‚Â¬ÃƒÂ¢Ã¢â‚¬Å¾Ã‚Â¢ÃƒÆ’Ã†â€™Ãƒâ€ Ã¢â‚¬â„¢ÃƒÆ’Ã‚Â¢ÃƒÂ¢Ã¢â‚¬Å¡Ã‚Â¬Ãƒâ€¦Ã‚Â¡ÃƒÆ’Ã†â€™ÃƒÂ¢Ã¢â€šÂ¬Ã…Â¡ÃƒÆ’Ã¢â‚¬Å¡Ãƒâ€šÃ‚Â¢ÃƒÆ’Ã†â€™Ãƒâ€ Ã¢â‚¬â„¢ÃƒÆ’Ã¢â‚¬Â ÃƒÂ¢Ã¢â€šÂ¬Ã¢â€žÂ¢ÃƒÆ’Ã†â€™ÃƒÂ¢Ã¢â€šÂ¬Ã…Â¡ÃƒÆ’Ã¢â‚¬Å¡Ãƒâ€šÃ‚Â¢ÃƒÆ’Ã†â€™Ãƒâ€ Ã¢â‚¬â„¢ÃƒÆ’Ã¢â‚¬Å¡Ãƒâ€šÃ‚Â¢ÃƒÆ’Ã†â€™Ãƒâ€šÃ‚Â¢ÃƒÆ’Ã‚Â¢ÃƒÂ¢Ã¢â‚¬Å¡Ã‚Â¬Ãƒâ€¦Ã‚Â¡ÃƒÆ’Ã¢â‚¬Å¡Ãƒâ€šÃ‚Â¬ÃƒÆ’Ã†â€™ÃƒÂ¢Ã¢â€šÂ¬Ã‚Â¦ÃƒÆ’Ã¢â‚¬Å¡Ãƒâ€šÃ‚Â¡ÃƒÆ’Ã†â€™Ãƒâ€ Ã¢â‚¬â„¢ÃƒÆ’Ã‚Â¢ÃƒÂ¢Ã¢â‚¬Å¡Ã‚Â¬Ãƒâ€¦Ã‚Â¡ÃƒÆ’Ã†â€™ÃƒÂ¢Ã¢â€šÂ¬Ã…Â¡ÃƒÆ’Ã¢â‚¬Å¡Ãƒâ€šÃ‚Â¬ÃƒÆ’Ã†â€™Ãƒâ€ Ã¢â‚¬â„¢ÃƒÆ’Ã¢â‚¬Â ÃƒÂ¢Ã¢â€šÂ¬Ã¢â€žÂ¢ÃƒÆ’Ã†â€™Ãƒâ€šÃ‚Â¢ÃƒÆ’Ã‚Â¢ÃƒÂ¢Ã¢â€šÂ¬Ã…Â¡Ãƒâ€šÃ‚Â¬ÃƒÆ’Ã¢â‚¬Å¡Ãƒâ€šÃ‚Â¦ÃƒÆ’Ã†â€™Ãƒâ€ Ã¢â‚¬â„¢ÃƒÆ’Ã‚Â¢ÃƒÂ¢Ã¢â‚¬Å¡Ã‚Â¬Ãƒâ€¦Ã‚Â¡ÃƒÆ’Ã†â€™ÃƒÂ¢Ã¢â€šÂ¬Ã…Â¡ÃƒÆ’Ã¢â‚¬Å¡Ãƒâ€šÃ‚Â¡ÃƒÆ’Ã†â€™Ãƒâ€ Ã¢â‚¬â„¢ÃƒÆ’Ã¢â‚¬Â ÃƒÂ¢Ã¢â€šÂ¬Ã¢â€žÂ¢ÃƒÆ’Ã†â€™ÃƒÂ¢Ã¢â€šÂ¬Ã‚Â ÃƒÆ’Ã‚Â¢ÃƒÂ¢Ã¢â‚¬Å¡Ã‚Â¬ÃƒÂ¢Ã¢â‚¬Å¾Ã‚Â¢ÃƒÆ’Ã†â€™Ãƒâ€ Ã¢â‚¬â„¢ÃƒÆ’Ã‚Â¢ÃƒÂ¢Ã¢â‚¬Å¡Ã‚Â¬Ãƒâ€šÃ‚Â ÃƒÆ’Ã†â€™Ãƒâ€šÃ‚Â¢ÃƒÆ’Ã‚Â¢ÃƒÂ¢Ã¢â€šÂ¬Ã…Â¡Ãƒâ€šÃ‚Â¬ÃƒÆ’Ã‚Â¢ÃƒÂ¢Ã¢â€šÂ¬Ã…Â¾Ãƒâ€šÃ‚Â¢ÃƒÆ’Ã†â€™Ãƒâ€ Ã¢â‚¬â„¢ÃƒÆ’Ã¢â‚¬Â ÃƒÂ¢Ã¢â€šÂ¬Ã¢â€žÂ¢ÃƒÆ’Ã†â€™ÃƒÂ¢Ã¢â€šÂ¬Ã…Â¡ÃƒÆ’Ã¢â‚¬Å¡Ãƒâ€šÃ‚Â¢ÃƒÆ’Ã†â€™Ãƒâ€ Ã¢â‚¬â„¢ÃƒÆ’Ã¢â‚¬Å¡Ãƒâ€šÃ‚Â¢ÃƒÆ’Ã†â€™Ãƒâ€šÃ‚Â¢ÃƒÆ’Ã‚Â¢ÃƒÂ¢Ã¢â€šÂ¬Ã…Â¡Ãƒâ€šÃ‚Â¬ÃƒÆ’Ã¢â‚¬Â¦Ãƒâ€šÃ‚Â¡ÃƒÆ’Ã†â€™ÃƒÂ¢Ã¢â€šÂ¬Ã…Â¡ÃƒÆ’Ã¢â‚¬Å¡Ãƒâ€šÃ‚Â¬ÃƒÆ’Ã†â€™Ãƒâ€ Ã¢â‚¬â„¢ÃƒÆ’Ã‚Â¢ÃƒÂ¢Ã¢â‚¬Å¡Ã‚Â¬Ãƒâ€šÃ‚Â¦ÃƒÆ’Ã†â€™ÃƒÂ¢Ã¢â€šÂ¬Ã…Â¡ÃƒÆ’Ã¢â‚¬Å¡Ãƒâ€šÃ‚Â¡ÃƒÆ’Ã†â€™Ãƒâ€ Ã¢â‚¬â„¢ÃƒÆ’Ã¢â‚¬Â ÃƒÂ¢Ã¢â€šÂ¬Ã¢â€žÂ¢ÃƒÆ’Ã†â€™ÃƒÂ¢Ã¢â€šÂ¬Ã‚Â ÃƒÆ’Ã‚Â¢ÃƒÂ¢Ã¢â‚¬Å¡Ã‚Â¬ÃƒÂ¢Ã¢â‚¬Å¾Ã‚Â¢ÃƒÆ’Ã†â€™Ãƒâ€ Ã¢â‚¬â„¢ÃƒÆ’Ã¢â‚¬Å¡Ãƒâ€šÃ‚Â¢ÃƒÆ’Ã†â€™Ãƒâ€šÃ‚Â¢ÃƒÆ’Ã‚Â¢ÃƒÂ¢Ã¢â‚¬Å¡Ã‚Â¬Ãƒâ€¦Ã‚Â¡ÃƒÆ’Ã¢â‚¬Å¡Ãƒâ€šÃ‚Â¬ÃƒÆ’Ã†â€™ÃƒÂ¢Ã¢â€šÂ¬Ã‚Â¦ÃƒÆ’Ã¢â‚¬Å¡Ãƒâ€šÃ‚Â¡ÃƒÆ’Ã†â€™Ãƒâ€ Ã¢â‚¬â„¢ÃƒÆ’Ã¢â‚¬Â ÃƒÂ¢Ã¢â€šÂ¬Ã¢â€žÂ¢ÃƒÆ’Ã†â€™Ãƒâ€šÃ‚Â¢ÃƒÆ’Ã‚Â¢ÃƒÂ¢Ã¢â€šÂ¬Ã…Â¡Ãƒâ€šÃ‚Â¬ÃƒÆ’Ã¢â‚¬Â¦Ãƒâ€šÃ‚Â¡ÃƒÆ’Ã†â€™Ãƒâ€ Ã¢â‚¬â„¢ÃƒÆ’Ã‚Â¢ÃƒÂ¢Ã¢â‚¬Å¡Ã‚Â¬Ãƒâ€¦Ã‚Â¡ÃƒÆ’Ã†â€™ÃƒÂ¢Ã¢â€šÂ¬Ã…Â¡ÃƒÆ’Ã¢â‚¬Å¡Ãƒâ€šÃ‚Â°C at the beginning to a minimum of around 25.6ÃƒÆ’Ã†â€™Ãƒâ€ Ã¢â‚¬â„¢ÃƒÆ’Ã¢â‚¬Â ÃƒÂ¢Ã¢â€šÂ¬Ã¢â€žÂ¢ÃƒÆ’Ã†â€™ÃƒÂ¢Ã¢â€šÂ¬Ã‚Â ÃƒÆ’Ã‚Â¢ÃƒÂ¢Ã¢â‚¬Å¡Ã‚Â¬ÃƒÂ¢Ã¢â‚¬Å¾Ã‚Â¢ÃƒÆ’Ã†â€™Ãƒâ€ Ã¢â‚¬â„¢ÃƒÆ’Ã‚Â¢ÃƒÂ¢Ã¢â‚¬Å¡Ã‚Â¬Ãƒâ€šÃ‚Â ÃƒÆ’Ã†â€™Ãƒâ€šÃ‚Â¢ÃƒÆ’Ã‚Â¢ÃƒÂ¢Ã¢â€šÂ¬Ã…Â¡Ãƒâ€šÃ‚Â¬ÃƒÆ’Ã‚Â¢ÃƒÂ¢Ã¢â€šÂ¬Ã…Â¾Ãƒâ€šÃ‚Â¢ÃƒÆ’Ã†â€™Ãƒâ€ Ã¢â‚¬â„¢ÃƒÆ’Ã¢â‚¬Â ÃƒÂ¢Ã¢â€šÂ¬Ã¢â€žÂ¢ÃƒÆ’Ã†â€™Ãƒâ€šÃ‚Â¢ÃƒÆ’Ã‚Â¢ÃƒÂ¢Ã¢â€šÂ¬Ã…Â¡Ãƒâ€šÃ‚Â¬ÃƒÆ’Ã¢â‚¬Å¡Ãƒâ€šÃ‚Â ÃƒÆ’Ã†â€™Ãƒâ€ Ã¢â‚¬â„¢ÃƒÆ’Ã¢â‚¬Å¡Ãƒâ€šÃ‚Â¢ÃƒÆ’Ã†â€™Ãƒâ€šÃ‚Â¢ÃƒÆ’Ã‚Â¢ÃƒÂ¢Ã¢â‚¬Å¡Ã‚Â¬Ãƒâ€¦Ã‚Â¡ÃƒÆ’Ã¢â‚¬Å¡Ãƒâ€šÃ‚Â¬ÃƒÆ’Ã†â€™Ãƒâ€šÃ‚Â¢ÃƒÆ’Ã‚Â¢ÃƒÂ¢Ã¢â‚¬Å¡Ã‚Â¬Ãƒâ€¦Ã‚Â¾ÃƒÆ’Ã¢â‚¬Å¡Ãƒâ€šÃ‚Â¢ÃƒÆ’Ã†â€™Ãƒâ€ Ã¢â‚¬â„¢ÃƒÆ’Ã¢â‚¬Â ÃƒÂ¢Ã¢â€šÂ¬Ã¢â€žÂ¢ÃƒÆ’Ã†â€™ÃƒÂ¢Ã¢â€šÂ¬Ã‚Â ÃƒÆ’Ã‚Â¢ÃƒÂ¢Ã¢â‚¬Å¡Ã‚Â¬ÃƒÂ¢Ã¢â‚¬Å¾Ã‚Â¢ÃƒÆ’Ã†â€™Ãƒâ€ Ã¢â‚¬â„¢ÃƒÆ’Ã¢â‚¬Å¡Ãƒâ€šÃ‚Â¢ÃƒÆ’Ã†â€™Ãƒâ€šÃ‚Â¢ÃƒÆ’Ã‚Â¢ÃƒÂ¢Ã¢â‚¬Å¡Ã‚Â¬Ãƒâ€¦Ã‚Â¡ÃƒÆ’Ã¢â‚¬Å¡Ãƒâ€šÃ‚Â¬ÃƒÆ’Ã†â€™ÃƒÂ¢Ã¢â€šÂ¬Ã‚Â¦ÃƒÆ’Ã¢â‚¬Å¡Ãƒâ€šÃ‚Â¡ÃƒÆ’Ã†â€™Ãƒâ€ Ã¢â‚¬â„¢ÃƒÆ’Ã¢â‚¬Â ÃƒÂ¢Ã¢â€šÂ¬Ã¢â€žÂ¢ÃƒÆ’Ã†â€™Ãƒâ€šÃ‚Â¢ÃƒÆ’Ã‚Â¢ÃƒÂ¢Ã¢â€šÂ¬Ã…Â¡Ãƒâ€šÃ‚Â¬ÃƒÆ’Ã¢â‚¬Â¦Ãƒâ€šÃ‚Â¡ÃƒÆ’Ã†â€™Ãƒâ€ Ã¢â‚¬â„¢ÃƒÆ’Ã‚Â¢ÃƒÂ¢Ã¢â‚¬Å¡Ã‚Â¬Ãƒâ€¦Ã‚Â¡ÃƒÆ’Ã†â€™ÃƒÂ¢Ã¢â€šÂ¬Ã…Â¡ÃƒÆ’Ã¢â‚¬Å¡Ãƒâ€šÃ‚Â¢ÃƒÆ’Ã†â€™Ãƒâ€ Ã¢â‚¬â„¢ÃƒÆ’Ã¢â‚¬Â ÃƒÂ¢Ã¢â€šÂ¬Ã¢â€žÂ¢ÃƒÆ’Ã†â€™ÃƒÂ¢Ã¢â€šÂ¬Ã‚Â ÃƒÆ’Ã‚Â¢ÃƒÂ¢Ã¢â‚¬Å¡Ã‚Â¬ÃƒÂ¢Ã¢â‚¬Å¾Ã‚Â¢ÃƒÆ’Ã†â€™Ãƒâ€ Ã¢â‚¬â„¢ÃƒÆ’Ã‚Â¢ÃƒÂ¢Ã¢â‚¬Å¡Ã‚Â¬Ãƒâ€šÃ‚Â ÃƒÆ’Ã†â€™Ãƒâ€šÃ‚Â¢ÃƒÆ’Ã‚Â¢ÃƒÂ¢Ã¢â€šÂ¬Ã…Â¡Ãƒâ€šÃ‚Â¬ÃƒÆ’Ã‚Â¢ÃƒÂ¢Ã¢â€šÂ¬Ã…Â¾Ãƒâ€šÃ‚Â¢ÃƒÆ’Ã†â€™Ãƒâ€ Ã¢â‚¬â„¢ÃƒÆ’Ã¢â‚¬Â ÃƒÂ¢Ã¢â€šÂ¬Ã¢â€žÂ¢ÃƒÆ’Ã†â€™Ãƒâ€šÃ‚Â¢ÃƒÆ’Ã‚Â¢ÃƒÂ¢Ã¢â€šÂ¬Ã…Â¡Ãƒâ€šÃ‚Â¬ÃƒÆ’Ã¢â‚¬Â¦Ãƒâ€šÃ‚Â¡ÃƒÆ’Ã†â€™Ãƒâ€ Ã¢â‚¬â„¢ÃƒÆ’Ã‚Â¢ÃƒÂ¢Ã¢â‚¬Å¡Ã‚Â¬Ãƒâ€¦Ã‚Â¡ÃƒÆ’Ã†â€™ÃƒÂ¢Ã¢â€šÂ¬Ã…Â¡ÃƒÆ’Ã¢â‚¬Å¡Ãƒâ€šÃ‚Â¢ÃƒÆ’Ã†â€™Ãƒâ€ Ã¢â‚¬â„¢ÃƒÆ’Ã¢â‚¬Â ÃƒÂ¢Ã¢â€šÂ¬Ã¢â€žÂ¢ÃƒÆ’Ã†â€™ÃƒÂ¢Ã¢â€šÂ¬Ã‚Â ÃƒÆ’Ã‚Â¢ÃƒÂ¢Ã¢â‚¬Å¡Ã‚Â¬ÃƒÂ¢Ã¢â‚¬Å¾Ã‚Â¢ÃƒÆ’Ã†â€™Ãƒâ€ Ã¢â‚¬â„¢ÃƒÆ’Ã‚Â¢ÃƒÂ¢Ã¢â‚¬Å¡Ã‚Â¬Ãƒâ€¦Ã‚Â¡ÃƒÆ’Ã†â€™ÃƒÂ¢Ã¢â€šÂ¬Ã…Â¡ÃƒÆ’Ã¢â‚¬Å¡Ãƒâ€šÃ‚Â¢ÃƒÆ’Ã†â€™Ãƒâ€ Ã¢â‚¬â„¢ÃƒÆ’Ã¢â‚¬Â ÃƒÂ¢Ã¢â€šÂ¬Ã¢â€žÂ¢ÃƒÆ’Ã†â€™ÃƒÂ¢Ã¢â€šÂ¬Ã…Â¡ÃƒÆ’Ã¢â‚¬Å¡Ãƒâ€šÃ‚Â¢ÃƒÆ’Ã†â€™Ãƒâ€ Ã¢â‚¬â„¢ÃƒÆ’Ã¢â‚¬Å¡Ãƒâ€šÃ‚Â¢ÃƒÆ’Ã†â€™Ãƒâ€šÃ‚Â¢ÃƒÆ’Ã‚Â¢ÃƒÂ¢Ã¢â‚¬Å¡Ã‚Â¬Ãƒâ€¦Ã‚Â¡ÃƒÆ’Ã¢â‚¬Å¡Ãƒâ€šÃ‚Â¬ÃƒÆ’Ã†â€™ÃƒÂ¢Ã¢â€šÂ¬Ã‚Â¦ÃƒÆ’Ã¢â‚¬Å¡Ãƒâ€šÃ‚Â¡ÃƒÆ’Ã†â€™Ãƒâ€ Ã¢â‚¬â„¢ÃƒÆ’Ã‚Â¢ÃƒÂ¢Ã¢â‚¬Å¡Ã‚Â¬Ãƒâ€¦Ã‚Â¡ÃƒÆ’Ã†â€™ÃƒÂ¢Ã¢â€šÂ¬Ã…Â¡ÃƒÆ’Ã¢â‚¬Å¡Ãƒâ€šÃ‚Â¬ÃƒÆ’Ã†â€™Ãƒâ€ Ã¢â‚¬â„¢ÃƒÆ’Ã¢â‚¬Â ÃƒÂ¢Ã¢â€šÂ¬Ã¢â€žÂ¢ÃƒÆ’Ã†â€™Ãƒâ€šÃ‚Â¢ÃƒÆ’Ã‚Â¢ÃƒÂ¢Ã¢â€šÂ¬Ã…Â¡Ãƒâ€šÃ‚Â¬ÃƒÆ’Ã¢â‚¬Å¡Ãƒâ€šÃ‚Â¦ÃƒÆ’Ã†â€™Ãƒâ€ Ã¢â‚¬â„¢ÃƒÆ’Ã‚Â¢ÃƒÂ¢Ã¢â‚¬Å¡Ã‚Â¬Ãƒâ€¦Ã‚Â¡ÃƒÆ’Ã†â€™ÃƒÂ¢Ã¢â€šÂ¬Ã…Â¡ÃƒÆ’Ã¢â‚¬Å¡Ãƒâ€šÃ‚Â¡ÃƒÆ’Ã†â€™Ãƒâ€ Ã¢â‚¬â„¢ÃƒÆ’Ã¢â‚¬Â ÃƒÂ¢Ã¢â€šÂ¬Ã¢â€žÂ¢ÃƒÆ’Ã†â€™ÃƒÂ¢Ã¢â€šÂ¬Ã‚Â ÃƒÆ’Ã‚Â¢ÃƒÂ¢Ã¢â‚¬Å¡Ã‚Â¬ÃƒÂ¢Ã¢â‚¬Å¾Ã‚Â¢ÃƒÆ’Ã†â€™Ãƒâ€ Ã¢â‚¬â„¢ÃƒÆ’Ã¢â‚¬Å¡Ãƒâ€šÃ‚Â¢ÃƒÆ’Ã†â€™Ãƒâ€šÃ‚Â¢ÃƒÆ’Ã‚Â¢ÃƒÂ¢Ã¢â‚¬Å¡Ã‚Â¬Ãƒâ€¦Ã‚Â¡ÃƒÆ’Ã¢â‚¬Å¡Ãƒâ€šÃ‚Â¬ÃƒÆ’Ã†â€™ÃƒÂ¢Ã¢â€šÂ¬Ã‚Â¦ÃƒÆ’Ã¢â‚¬Å¡Ãƒâ€šÃ‚Â¡ÃƒÆ’Ã†â€™Ãƒâ€ Ã¢â‚¬â„¢ÃƒÆ’Ã¢â‚¬Â ÃƒÂ¢Ã¢â€šÂ¬Ã¢â€žÂ¢ÃƒÆ’Ã†â€™Ãƒâ€šÃ‚Â¢ÃƒÆ’Ã‚Â¢ÃƒÂ¢Ã¢â€šÂ¬Ã…Â¡Ãƒâ€šÃ‚Â¬ÃƒÆ’Ã¢â‚¬Â¦Ãƒâ€šÃ‚Â¡ÃƒÆ’Ã†â€™Ãƒâ€ Ã¢â‚¬â„¢ÃƒÆ’Ã‚Â¢ÃƒÂ¢Ã¢â‚¬Å¡Ã‚Â¬Ãƒâ€¦Ã‚Â¡ÃƒÆ’Ã†â€™ÃƒÂ¢Ã¢â€šÂ¬Ã…Â¡ÃƒÆ’Ã¢â‚¬Å¡Ãƒâ€šÃ‚Â¬ÃƒÆ’Ã†â€™Ãƒâ€ Ã¢â‚¬â„¢ÃƒÆ’Ã¢â‚¬Â ÃƒÂ¢Ã¢â€šÂ¬Ã¢â€žÂ¢ÃƒÆ’Ã†â€™ÃƒÂ¢Ã¢â€šÂ¬Ã‚Â ÃƒÆ’Ã‚Â¢ÃƒÂ¢Ã¢â‚¬Å¡Ã‚Â¬ÃƒÂ¢Ã¢â‚¬Å¾Ã‚Â¢ÃƒÆ’Ã†â€™Ãƒâ€ Ã¢â‚¬â„¢ÃƒÆ’Ã‚Â¢ÃƒÂ¢Ã¢â‚¬Å¡Ã‚Â¬Ãƒâ€šÃ‚Â ÃƒÆ’Ã†â€™Ãƒâ€šÃ‚Â¢ÃƒÆ’Ã‚Â¢ÃƒÂ¢Ã¢â€šÂ¬Ã…Â¡Ãƒâ€šÃ‚Â¬ÃƒÆ’Ã‚Â¢ÃƒÂ¢Ã¢â€šÂ¬Ã…Â¾Ãƒâ€šÃ‚Â¢ÃƒÆ’Ã†â€™Ãƒâ€ Ã¢â‚¬â„¢ÃƒÆ’Ã¢â‚¬Â ÃƒÂ¢Ã¢â€šÂ¬Ã¢â€žÂ¢ÃƒÆ’Ã†â€™Ãƒâ€šÃ‚Â¢ÃƒÆ’Ã‚Â¢ÃƒÂ¢Ã¢â€šÂ¬Ã…Â¡Ãƒâ€šÃ‚Â¬ÃƒÆ’Ã¢â‚¬Â¦Ãƒâ€šÃ‚Â¡ÃƒÆ’Ã†â€™Ãƒâ€ Ã¢â‚¬â„¢ÃƒÆ’Ã‚Â¢ÃƒÂ¢Ã¢â‚¬Å¡Ã‚Â¬Ãƒâ€¦Ã‚Â¡ÃƒÆ’Ã†â€™ÃƒÂ¢Ã¢â€šÂ¬Ã…Â¡ÃƒÆ’Ã¢â‚¬Å¡Ãƒâ€šÃ‚Â¢ÃƒÆ’Ã†â€™Ãƒâ€ Ã¢â‚¬â„¢ÃƒÆ’Ã¢â‚¬Â ÃƒÂ¢Ã¢â€šÂ¬Ã¢â€žÂ¢ÃƒÆ’Ã†â€™ÃƒÂ¢Ã¢â€šÂ¬Ã‚Â ÃƒÆ’Ã‚Â¢ÃƒÂ¢Ã¢â‚¬Å¡Ã‚Â¬ÃƒÂ¢Ã¢â‚¬Å¾Ã‚Â¢ÃƒÆ’Ã†â€™Ãƒâ€ Ã¢â‚¬â„¢ÃƒÆ’Ã‚Â¢ÃƒÂ¢Ã¢â‚¬Å¡Ã‚Â¬Ãƒâ€¦Ã‚Â¡ÃƒÆ’Ã†â€™ÃƒÂ¢Ã¢â€šÂ¬Ã…Â¡ÃƒÆ’Ã¢â‚¬Å¡Ãƒâ€šÃ‚Â¢ÃƒÆ’Ã†â€™Ãƒâ€ Ã¢â‚¬â„¢ÃƒÆ’Ã¢â‚¬Â ÃƒÂ¢Ã¢â€šÂ¬Ã¢â€žÂ¢ÃƒÆ’Ã†â€™ÃƒÂ¢Ã¢â€šÂ¬Ã…Â¡ÃƒÆ’Ã¢â‚¬Å¡Ãƒâ€šÃ‚Â¢ÃƒÆ’Ã†â€™Ãƒâ€ Ã¢â‚¬â„¢ÃƒÆ’Ã¢â‚¬Å¡Ãƒâ€šÃ‚Â¢ÃƒÆ’Ã†â€™Ãƒâ€šÃ‚Â¢ÃƒÆ’Ã‚Â¢ÃƒÂ¢Ã¢â€šÂ¬Ã…Â¡Ãƒâ€šÃ‚Â¬ÃƒÆ’Ã¢â‚¬Â¦Ãƒâ€šÃ‚Â¡ÃƒÆ’Ã†â€™ÃƒÂ¢Ã¢â€šÂ¬Ã…Â¡ÃƒÆ’Ã¢â‚¬Å¡Ãƒâ€šÃ‚Â¬ÃƒÆ’Ã†â€™Ãƒâ€ Ã¢â‚¬â„¢ÃƒÆ’Ã‚Â¢ÃƒÂ¢Ã¢â‚¬Å¡Ã‚Â¬Ãƒâ€šÃ‚Â¦ÃƒÆ’Ã†â€™ÃƒÂ¢Ã¢â€šÂ¬Ã…Â¡ÃƒÆ’Ã¢â‚¬Å¡Ãƒâ€šÃ‚Â¡ÃƒÆ’Ã†â€™Ãƒâ€ Ã¢â‚¬â„¢ÃƒÆ’Ã¢â‚¬Â ÃƒÂ¢Ã¢â€šÂ¬Ã¢â€žÂ¢ÃƒÆ’Ã†â€™Ãƒâ€šÃ‚Â¢ÃƒÆ’Ã‚Â¢ÃƒÂ¢Ã¢â€šÂ¬Ã…Â¡Ãƒâ€šÃ‚Â¬ÃƒÆ’Ã¢â‚¬Â¦Ãƒâ€šÃ‚Â¡ÃƒÆ’Ã†â€™Ãƒâ€ Ã¢â‚¬â„¢ÃƒÆ’Ã‚Â¢ÃƒÂ¢Ã¢â‚¬Å¡Ã‚Â¬Ãƒâ€¦Ã‚Â¡ÃƒÆ’Ã†â€™ÃƒÂ¢Ã¢â€šÂ¬Ã…Â¡ÃƒÆ’Ã¢â‚¬Å¡Ãƒâ€šÃ‚Â¬ÃƒÆ’Ã†â€™Ãƒâ€ Ã¢â‚¬â„¢ÃƒÆ’Ã¢â‚¬Â ÃƒÂ¢Ã¢â€šÂ¬Ã¢â€žÂ¢ÃƒÆ’Ã†â€™ÃƒÂ¢Ã¢â€šÂ¬Ã‚Â ÃƒÆ’Ã‚Â¢ÃƒÂ¢Ã¢â‚¬Å¡Ã‚Â¬ÃƒÂ¢Ã¢â‚¬Å¾Ã‚Â¢ÃƒÆ’Ã†â€™Ãƒâ€ Ã¢â‚¬â„¢ÃƒÆ’Ã¢â‚¬Å¡Ãƒâ€šÃ‚Â¢ÃƒÆ’Ã†â€™Ãƒâ€šÃ‚Â¢ÃƒÆ’Ã‚Â¢ÃƒÂ¢Ã¢â‚¬Å¡Ã‚Â¬Ãƒâ€¦Ã‚Â¡ÃƒÆ’Ã¢â‚¬Å¡Ãƒâ€šÃ‚Â¬ÃƒÆ’Ã†â€™ÃƒÂ¢Ã¢â€šÂ¬Ã…Â¡ÃƒÆ’Ã¢â‚¬Å¡Ãƒâ€šÃ‚Â¦ÃƒÆ’Ã†â€™Ãƒâ€ Ã¢â‚¬â„¢ÃƒÆ’Ã¢â‚¬Â ÃƒÂ¢Ã¢â€šÂ¬Ã¢â€žÂ¢ÃƒÆ’Ã†â€™ÃƒÂ¢Ã¢â€šÂ¬Ã…Â¡ÃƒÆ’Ã¢â‚¬Å¡Ãƒâ€šÃ‚Â¢ÃƒÆ’Ã†â€™Ãƒâ€ Ã¢â‚¬â„¢ÃƒÆ’Ã¢â‚¬Å¡Ãƒâ€šÃ‚Â¢ÃƒÆ’Ã†â€™Ãƒâ€šÃ‚Â¢ÃƒÆ’Ã‚Â¢ÃƒÂ¢Ã¢â€šÂ¬Ã…Â¡Ãƒâ€šÃ‚Â¬ÃƒÆ’Ã¢â‚¬Â¦Ãƒâ€šÃ‚Â¡ÃƒÆ’Ã†â€™ÃƒÂ¢Ã¢â€šÂ¬Ã…Â¡ÃƒÆ’Ã¢â‚¬Å¡Ãƒâ€šÃ‚Â¬ÃƒÆ’Ã†â€™Ãƒâ€ Ã¢â‚¬â„¢ÃƒÆ’Ã‚Â¢ÃƒÂ¢Ã¢â‚¬Å¡Ã‚Â¬Ãƒâ€šÃ‚Â¦ÃƒÆ’Ã†â€™Ãƒâ€šÃ‚Â¢ÃƒÆ’Ã‚Â¢ÃƒÂ¢Ã¢â€šÂ¬Ã…Â¡Ãƒâ€šÃ‚Â¬ÃƒÆ’Ã¢â‚¬Â¦ÃƒÂ¢Ã¢â€šÂ¬Ã…â€œ25.9ÃƒÆ’Ã†â€™Ãƒâ€ Ã¢â‚¬â„¢ÃƒÆ’Ã¢â‚¬Â ÃƒÂ¢Ã¢â€šÂ¬Ã¢â€žÂ¢ÃƒÆ’Ã†â€™ÃƒÂ¢Ã¢â€šÂ¬Ã‚Â ÃƒÆ’Ã‚Â¢ÃƒÂ¢Ã¢â‚¬Å¡Ã‚Â¬ÃƒÂ¢Ã¢â‚¬Å¾Ã‚Â¢ÃƒÆ’Ã†â€™Ãƒâ€ Ã¢â‚¬â„¢ÃƒÆ’Ã‚Â¢ÃƒÂ¢Ã¢â‚¬Å¡Ã‚Â¬Ãƒâ€šÃ‚Â ÃƒÆ’Ã†â€™Ãƒâ€šÃ‚Â¢ÃƒÆ’Ã‚Â¢ÃƒÂ¢Ã¢â€šÂ¬Ã…Â¡Ãƒâ€šÃ‚Â¬ÃƒÆ’Ã‚Â¢ÃƒÂ¢Ã¢â€šÂ¬Ã…Â¾Ãƒâ€šÃ‚Â¢ÃƒÆ’Ã†â€™Ãƒâ€ Ã¢â‚¬â„¢ÃƒÆ’Ã¢â‚¬Â ÃƒÂ¢Ã¢â€šÂ¬Ã¢â€žÂ¢ÃƒÆ’Ã†â€™Ãƒâ€šÃ‚Â¢ÃƒÆ’Ã‚Â¢ÃƒÂ¢Ã¢â€šÂ¬Ã…Â¡Ãƒâ€šÃ‚Â¬ÃƒÆ’Ã¢â‚¬Å¡Ãƒâ€šÃ‚Â ÃƒÆ’Ã†â€™Ãƒâ€ Ã¢â‚¬â„¢ÃƒÆ’Ã¢â‚¬Å¡Ãƒâ€šÃ‚Â¢ÃƒÆ’Ã†â€™Ãƒâ€šÃ‚Â¢ÃƒÆ’Ã‚Â¢ÃƒÂ¢Ã¢â‚¬Å¡Ã‚Â¬Ãƒâ€¦Ã‚Â¡ÃƒÆ’Ã¢â‚¬Å¡Ãƒâ€šÃ‚Â¬ÃƒÆ’Ã†â€™Ãƒâ€šÃ‚Â¢ÃƒÆ’Ã‚Â¢ÃƒÂ¢Ã¢â‚¬Å¡Ã‚Â¬Ãƒâ€¦Ã‚Â¾ÃƒÆ’Ã¢â‚¬Å¡Ãƒâ€šÃ‚Â¢ÃƒÆ’Ã†â€™Ãƒâ€ Ã¢â‚¬â„¢ÃƒÆ’Ã¢â‚¬Â ÃƒÂ¢Ã¢â€šÂ¬Ã¢â€žÂ¢ÃƒÆ’Ã†â€™ÃƒÂ¢Ã¢â€šÂ¬Ã‚Â ÃƒÆ’Ã‚Â¢ÃƒÂ¢Ã¢â‚¬Å¡Ã‚Â¬ÃƒÂ¢Ã¢â‚¬Å¾Ã‚Â¢ÃƒÆ’Ã†â€™Ãƒâ€ Ã¢â‚¬â„¢ÃƒÆ’Ã‚Â¢ÃƒÂ¢Ã¢â‚¬Å¡Ã‚Â¬Ãƒâ€¦Ã‚Â¡ÃƒÆ’Ã†â€™ÃƒÂ¢Ã¢â€šÂ¬Ã…Â¡ÃƒÆ’Ã¢â‚¬Å¡Ãƒâ€šÃ‚Â¢ÃƒÆ’Ã†â€™Ãƒâ€ Ã¢â‚¬â„¢ÃƒÆ’Ã¢â‚¬Â ÃƒÂ¢Ã¢â€šÂ¬Ã¢â€žÂ¢ÃƒÆ’Ã†â€™ÃƒÂ¢Ã¢â€šÂ¬Ã…Â¡ÃƒÆ’Ã¢â‚¬Å¡Ãƒâ€šÃ‚Â¢ÃƒÆ’Ã†â€™Ãƒâ€ Ã¢â‚¬â„¢ÃƒÆ’Ã¢â‚¬Å¡Ãƒâ€šÃ‚Â¢ÃƒÆ’Ã†â€™Ãƒâ€šÃ‚Â¢ÃƒÆ’Ã‚Â¢ÃƒÂ¢Ã¢â‚¬Å¡Ã‚Â¬Ãƒâ€¦Ã‚Â¡ÃƒÆ’Ã¢â‚¬Å¡Ãƒâ€šÃ‚Â¬ÃƒÆ’Ã†â€™ÃƒÂ¢Ã¢â€šÂ¬Ã‚Â¦ÃƒÆ’Ã¢â‚¬Å¡Ãƒâ€šÃ‚Â¡ÃƒÆ’Ã†â€™Ãƒâ€ Ã¢â‚¬â„¢ÃƒÆ’Ã‚Â¢ÃƒÂ¢Ã¢â‚¬Å¡Ã‚Â¬Ãƒâ€¦Ã‚Â¡ÃƒÆ’Ã†â€™ÃƒÂ¢Ã¢â€šÂ¬Ã…Â¡ÃƒÆ’Ã¢â‚¬Å¡Ãƒâ€šÃ‚Â¬ÃƒÆ’Ã†â€™Ãƒâ€ Ã¢â‚¬â„¢ÃƒÆ’Ã¢â‚¬Â ÃƒÂ¢Ã¢â€šÂ¬Ã¢â€žÂ¢ÃƒÆ’Ã†â€™Ãƒâ€šÃ‚Â¢ÃƒÆ’Ã‚Â¢ÃƒÂ¢Ã¢â€šÂ¬Ã…Â¡Ãƒâ€šÃ‚Â¬ÃƒÆ’Ã¢â‚¬Å¡Ãƒâ€šÃ‚Â¦ÃƒÆ’Ã†â€™Ãƒâ€ Ã¢â‚¬â„¢ÃƒÆ’Ã‚Â¢ÃƒÂ¢Ã¢â‚¬Å¡Ã‚Â¬Ãƒâ€¦Ã‚Â¡ÃƒÆ’Ã†â€™ÃƒÂ¢Ã¢â€šÂ¬Ã…Â¡ÃƒÆ’Ã¢â‚¬Å¡Ãƒâ€šÃ‚Â¡ÃƒÆ’Ã†â€™Ãƒâ€ Ã¢â‚¬â„¢ÃƒÆ’Ã¢â‚¬Â ÃƒÂ¢Ã¢â€šÂ¬Ã¢â€žÂ¢ÃƒÆ’Ã†â€™ÃƒÂ¢Ã¢â€šÂ¬Ã‚Â ÃƒÆ’Ã‚Â¢ÃƒÂ¢Ã¢â‚¬Å¡Ã‚Â¬ÃƒÂ¢Ã¢â‚¬Å¾Ã‚Â¢ÃƒÆ’Ã†â€™Ãƒâ€ Ã¢â‚¬â„¢ÃƒÆ’Ã‚Â¢ÃƒÂ¢Ã¢â‚¬Å¡Ã‚Â¬Ãƒâ€šÃ‚Â ÃƒÆ’Ã†â€™Ãƒâ€šÃ‚Â¢ÃƒÆ’Ã‚Â¢ÃƒÂ¢Ã¢â€šÂ¬Ã…Â¡Ãƒâ€šÃ‚Â¬ÃƒÆ’Ã‚Â¢ÃƒÂ¢Ã¢â€šÂ¬Ã…Â¾Ãƒâ€šÃ‚Â¢ÃƒÆ’Ã†â€™Ãƒâ€ Ã¢â‚¬â„¢ÃƒÆ’Ã¢â‚¬Â ÃƒÂ¢Ã¢â€šÂ¬Ã¢â€žÂ¢ÃƒÆ’Ã†â€™ÃƒÂ¢Ã¢â€šÂ¬Ã…Â¡ÃƒÆ’Ã¢â‚¬Å¡Ãƒâ€šÃ‚Â¢ÃƒÆ’Ã†â€™Ãƒâ€ Ã¢â‚¬â„¢ÃƒÆ’Ã¢â‚¬Å¡Ãƒâ€šÃ‚Â¢ÃƒÆ’Ã†â€™Ãƒâ€šÃ‚Â¢ÃƒÆ’Ã‚Â¢ÃƒÂ¢Ã¢â€šÂ¬Ã…Â¡Ãƒâ€šÃ‚Â¬ÃƒÆ’Ã¢â‚¬Â¦Ãƒâ€šÃ‚Â¡ÃƒÆ’Ã†â€™ÃƒÂ¢Ã¢â€šÂ¬Ã…Â¡ÃƒÆ’Ã¢â‚¬Å¡Ãƒâ€šÃ‚Â¬ÃƒÆ’Ã†â€™Ãƒâ€ Ã¢â‚¬â„¢ÃƒÆ’Ã‚Â¢ÃƒÂ¢Ã¢â‚¬Å¡Ã‚Â¬Ãƒâ€šÃ‚Â¦ÃƒÆ’Ã†â€™ÃƒÂ¢Ã¢â€šÂ¬Ã…Â¡ÃƒÆ’Ã¢â‚¬Å¡Ãƒâ€šÃ‚Â¡ÃƒÆ’Ã†â€™Ãƒâ€ Ã¢â‚¬â„¢ÃƒÆ’Ã¢â‚¬Â ÃƒÂ¢Ã¢â€šÂ¬Ã¢â€žÂ¢ÃƒÆ’Ã†â€™ÃƒÂ¢Ã¢â€šÂ¬Ã‚Â ÃƒÆ’Ã‚Â¢ÃƒÂ¢Ã¢â‚¬Å¡Ã‚Â¬ÃƒÂ¢Ã¢â‚¬Å¾Ã‚Â¢ÃƒÆ’Ã†â€™Ãƒâ€ Ã¢â‚¬â„¢ÃƒÆ’Ã¢â‚¬Å¡Ãƒâ€šÃ‚Â¢ÃƒÆ’Ã†â€™Ãƒâ€šÃ‚Â¢ÃƒÆ’Ã‚Â¢ÃƒÂ¢Ã¢â‚¬Å¡Ã‚Â¬Ãƒâ€¦Ã‚Â¡ÃƒÆ’Ã¢â‚¬Å¡Ãƒâ€šÃ‚Â¬ÃƒÆ’Ã†â€™ÃƒÂ¢Ã¢â€šÂ¬Ã‚Â¦ÃƒÆ’Ã¢â‚¬Å¡Ãƒâ€šÃ‚Â¡ÃƒÆ’Ã†â€™Ãƒâ€ Ã¢â‚¬â„¢ÃƒÆ’Ã¢â‚¬Â ÃƒÂ¢Ã¢â€šÂ¬Ã¢â€žÂ¢ÃƒÆ’Ã†â€™Ãƒâ€šÃ‚Â¢ÃƒÆ’Ã‚Â¢ÃƒÂ¢Ã¢â€šÂ¬Ã…Â¡Ãƒâ€šÃ‚Â¬ÃƒÆ’Ã¢â‚¬Â¦Ãƒâ€šÃ‚Â¡ÃƒÆ’Ã†â€™Ãƒâ€ Ã¢â‚¬â„¢ÃƒÆ’Ã‚Â¢ÃƒÂ¢Ã¢â‚¬Å¡Ã‚Â¬Ãƒâ€¦Ã‚Â¡ÃƒÆ’Ã†â€™ÃƒÂ¢Ã¢â€šÂ¬Ã…Â¡ÃƒÆ’Ã¢â‚¬Å¡Ãƒâ€šÃ‚Â°C in Week 4, before recovering and stabilizing at about 28.1ÃƒÆ’Ã†â€™Ãƒâ€ Ã¢â‚¬â„¢ÃƒÆ’Ã¢â‚¬Â ÃƒÂ¢Ã¢â€šÂ¬Ã¢â€žÂ¢ÃƒÆ’Ã†â€™ÃƒÂ¢Ã¢â€šÂ¬Ã‚Â ÃƒÆ’Ã‚Â¢ÃƒÂ¢Ã¢â‚¬Å¡Ã‚Â¬ÃƒÂ¢Ã¢â‚¬Å¾Ã‚Â¢ÃƒÆ’Ã†â€™Ãƒâ€ Ã¢â‚¬â„¢ÃƒÆ’Ã‚Â¢ÃƒÂ¢Ã¢â‚¬Å¡Ã‚Â¬Ãƒâ€šÃ‚Â ÃƒÆ’Ã†â€™Ãƒâ€šÃ‚Â¢ÃƒÆ’Ã‚Â¢ÃƒÂ¢Ã¢â€šÂ¬Ã…Â¡Ãƒâ€šÃ‚Â¬ÃƒÆ’Ã‚Â¢ÃƒÂ¢Ã¢â€šÂ¬Ã…Â¾Ãƒâ€šÃ‚Â¢ÃƒÆ’Ã†â€™Ãƒâ€ Ã¢â‚¬â„¢ÃƒÆ’Ã¢â‚¬Â ÃƒÂ¢Ã¢â€šÂ¬Ã¢â€žÂ¢ÃƒÆ’Ã†â€™Ãƒâ€šÃ‚Â¢ÃƒÆ’Ã‚Â¢ÃƒÂ¢Ã¢â€šÂ¬Ã…Â¡Ãƒâ€šÃ‚Â¬ÃƒÆ’Ã¢â‚¬Å¡Ãƒâ€šÃ‚Â ÃƒÆ’Ã†â€™Ãƒâ€ Ã¢â‚¬â„¢ÃƒÆ’Ã¢â‚¬Å¡Ãƒâ€šÃ‚Â¢ÃƒÆ’Ã†â€™Ãƒâ€šÃ‚Â¢ÃƒÆ’Ã‚Â¢ÃƒÂ¢Ã¢â‚¬Å¡Ã‚Â¬Ãƒâ€¦Ã‚Â¡ÃƒÆ’Ã¢â‚¬Å¡Ãƒâ€šÃ‚Â¬ÃƒÆ’Ã†â€™Ãƒâ€šÃ‚Â¢ÃƒÆ’Ã‚Â¢ÃƒÂ¢Ã¢â‚¬Å¡Ã‚Â¬Ãƒâ€¦Ã‚Â¾ÃƒÆ’Ã¢â‚¬Å¡Ãƒâ€šÃ‚Â¢ÃƒÆ’Ã†â€™Ãƒâ€ Ã¢â‚¬â„¢ÃƒÆ’Ã¢â‚¬Â ÃƒÂ¢Ã¢â€šÂ¬Ã¢â€žÂ¢ÃƒÆ’Ã†â€™ÃƒÂ¢Ã¢â€šÂ¬Ã‚Â ÃƒÆ’Ã‚Â¢ÃƒÂ¢Ã¢â‚¬Å¡Ã‚Â¬ÃƒÂ¢Ã¢â‚¬Å¾Ã‚Â¢ÃƒÆ’Ã†â€™Ãƒâ€ Ã¢â‚¬â„¢ÃƒÆ’Ã‚Â¢ÃƒÂ¢Ã¢â‚¬Å¡Ã‚Â¬Ãƒâ€¦Ã‚Â¡ÃƒÆ’Ã†â€™ÃƒÂ¢Ã¢â€šÂ¬Ã…Â¡ÃƒÆ’Ã¢â‚¬Å¡Ãƒâ€šÃ‚Â¢ÃƒÆ’Ã†â€™Ãƒâ€ Ã¢â‚¬â„¢ÃƒÆ’Ã¢â‚¬Â ÃƒÂ¢Ã¢â€šÂ¬Ã¢â€žÂ¢ÃƒÆ’Ã†â€™ÃƒÂ¢Ã¢â€šÂ¬Ã…Â¡ÃƒÆ’Ã¢â‚¬Å¡Ãƒâ€šÃ‚Â¢ÃƒÆ’Ã†â€™Ãƒâ€ Ã¢â‚¬â„¢ÃƒÆ’Ã¢â‚¬Å¡Ãƒâ€šÃ‚Â¢ÃƒÆ’Ã†â€™Ãƒâ€šÃ‚Â¢ÃƒÆ’Ã‚Â¢ÃƒÂ¢Ã¢â‚¬Å¡Ã‚Â¬Ãƒâ€¦Ã‚Â¡ÃƒÆ’Ã¢â‚¬Å¡Ãƒâ€šÃ‚Â¬ÃƒÆ’Ã†â€™ÃƒÂ¢Ã¢â€šÂ¬Ã‚Â¦ÃƒÆ’Ã¢â‚¬Å¡Ãƒâ€šÃ‚Â¡ÃƒÆ’Ã†â€™Ãƒâ€ Ã¢â‚¬â„¢ÃƒÆ’Ã‚Â¢ÃƒÂ¢Ã¢â‚¬Å¡Ã‚Â¬Ãƒâ€¦Ã‚Â¡ÃƒÆ’Ã†â€™ÃƒÂ¢Ã¢â€šÂ¬Ã…Â¡ÃƒÆ’Ã¢â‚¬Å¡Ãƒâ€šÃ‚Â¬ÃƒÆ’Ã†â€™Ãƒâ€ Ã¢â‚¬â„¢ÃƒÆ’Ã¢â‚¬Â ÃƒÂ¢Ã¢â€šÂ¬Ã¢â€žÂ¢ÃƒÆ’Ã†â€™Ãƒâ€šÃ‚Â¢ÃƒÆ’Ã‚Â¢ÃƒÂ¢Ã¢â€šÂ¬Ã…Â¡Ãƒâ€šÃ‚Â¬ÃƒÆ’Ã¢â‚¬Å¡Ãƒâ€šÃ‚Â¦ÃƒÆ’Ã†â€™Ãƒâ€ Ã¢â‚¬â„¢ÃƒÆ’Ã‚Â¢ÃƒÂ¢Ã¢â‚¬Å¡Ã‚Â¬Ãƒâ€¦Ã‚Â¡ÃƒÆ’Ã†â€™ÃƒÂ¢Ã¢â€šÂ¬Ã…Â¡ÃƒÆ’Ã¢â‚¬Å¡Ãƒâ€šÃ‚Â¡ÃƒÆ’Ã†â€™Ãƒâ€ Ã¢â‚¬â„¢ÃƒÆ’Ã¢â‚¬Â ÃƒÂ¢Ã¢â€šÂ¬Ã¢â€žÂ¢ÃƒÆ’Ã†â€™ÃƒÂ¢Ã¢â€šÂ¬Ã‚Â ÃƒÆ’Ã‚Â¢ÃƒÂ¢Ã¢â‚¬Å¡Ã‚Â¬ÃƒÂ¢Ã¢â‚¬Å¾Ã‚Â¢ÃƒÆ’Ã†â€™Ãƒâ€ Ã¢â‚¬â„¢ÃƒÆ’Ã‚Â¢ÃƒÂ¢Ã¢â‚¬Å¡Ã‚Â¬Ãƒâ€šÃ‚Â ÃƒÆ’Ã†â€™Ãƒâ€šÃ‚Â¢ÃƒÆ’Ã‚Â¢ÃƒÂ¢Ã¢â€šÂ¬Ã…Â¡Ãƒâ€šÃ‚Â¬ÃƒÆ’Ã‚Â¢ÃƒÂ¢Ã¢â€šÂ¬Ã…Â¾Ãƒâ€šÃ‚Â¢ÃƒÆ’Ã†â€™Ãƒâ€ Ã¢â‚¬â„¢ÃƒÆ’Ã¢â‚¬Â ÃƒÂ¢Ã¢â€šÂ¬Ã¢â€žÂ¢ÃƒÆ’Ã†â€™ÃƒÂ¢Ã¢â€šÂ¬Ã…Â¡ÃƒÆ’Ã¢â‚¬Å¡Ãƒâ€šÃ‚Â¢ÃƒÆ’Ã†â€™Ãƒâ€ Ã¢â‚¬â„¢ÃƒÆ’Ã¢â‚¬Å¡Ãƒâ€šÃ‚Â¢ÃƒÆ’Ã†â€™Ãƒâ€šÃ‚Â¢ÃƒÆ’Ã‚Â¢ÃƒÂ¢Ã¢â€šÂ¬Ã…Â¡Ãƒâ€šÃ‚Â¬ÃƒÆ’Ã¢â‚¬Â¦Ãƒâ€šÃ‚Â¡ÃƒÆ’Ã†â€™ÃƒÂ¢Ã¢â€šÂ¬Ã…Â¡ÃƒÆ’Ã¢â‚¬Å¡Ãƒâ€šÃ‚Â¬ÃƒÆ’Ã†â€™Ãƒâ€ Ã¢â‚¬â„¢ÃƒÆ’Ã‚Â¢ÃƒÂ¢Ã¢â‚¬Å¡Ã‚Â¬Ãƒâ€šÃ‚Â¦ÃƒÆ’Ã†â€™ÃƒÂ¢Ã¢â€šÂ¬Ã…Â¡ÃƒÆ’Ã¢â‚¬Å¡Ãƒâ€šÃ‚Â¡ÃƒÆ’Ã†â€™Ãƒâ€ Ã¢â‚¬â„¢ÃƒÆ’Ã¢â‚¬Â ÃƒÂ¢Ã¢â€šÂ¬Ã¢â€žÂ¢ÃƒÆ’Ã†â€™ÃƒÂ¢Ã¢â€šÂ¬Ã‚Â ÃƒÆ’Ã‚Â¢ÃƒÂ¢Ã¢â‚¬Å¡Ã‚Â¬ÃƒÂ¢Ã¢â‚¬Å¾Ã‚Â¢ÃƒÆ’Ã†â€™Ãƒâ€ Ã¢â‚¬â„¢ÃƒÆ’Ã¢â‚¬Å¡Ãƒâ€šÃ‚Â¢ÃƒÆ’Ã†â€™Ãƒâ€šÃ‚Â¢ÃƒÆ’Ã‚Â¢ÃƒÂ¢Ã¢â‚¬Å¡Ã‚Â¬Ãƒâ€¦Ã‚Â¡ÃƒÆ’Ã¢â‚¬Å¡Ãƒâ€šÃ‚Â¬ÃƒÆ’Ã†â€™ÃƒÂ¢Ã¢â€šÂ¬Ã‚Â¦ÃƒÆ’Ã¢â‚¬Å¡Ãƒâ€šÃ‚Â¡ÃƒÆ’Ã†â€™Ãƒâ€ Ã¢â‚¬â„¢ÃƒÆ’Ã¢â‚¬Â ÃƒÂ¢Ã¢â€šÂ¬Ã¢â€žÂ¢ÃƒÆ’Ã†â€™Ãƒâ€šÃ‚Â¢ÃƒÆ’Ã‚Â¢ÃƒÂ¢Ã¢â€šÂ¬Ã…Â¡Ãƒâ€šÃ‚Â¬ÃƒÆ’Ã¢â‚¬Â¦Ãƒâ€šÃ‚Â¡ÃƒÆ’Ã†â€™Ãƒâ€ Ã¢â‚¬â„¢ÃƒÆ’Ã‚Â¢ÃƒÂ¢Ã¢â‚¬Å¡Ã‚Â¬Ãƒâ€¦Ã‚Â¡ÃƒÆ’Ã†â€™ÃƒÂ¢Ã¢â€šÂ¬Ã…Â¡ÃƒÆ’Ã¢â‚¬Å¡Ãƒâ€šÃ‚Â°C by Week 7. Similarly, pH remained consistently alkaline throughout the study, with both treatments peaking in Week 4 (IMTA: 8.35; Monoculture: 8.37) and then gradually declining and stabilizing. From Week 3 onward, the IMTA system generally maintained slightly lower pH values compared to the Monoculture system.</w:t>
       </w:r>
     </w:p>
     <w:p>
@@ -8258,7 +8258,7 @@
           <w:sz w:val="28"/>
           <w:szCs w:val="28"/>
         </w:rPr>
-        <w:t>ÃƒÆ’Ã†â€™Ãƒâ€ Ã¢â‚¬â„¢ÃƒÆ’Ã¢â‚¬Â ÃƒÂ¢Ã¢â€šÂ¬Ã¢â€žÂ¢ÃƒÆ’Ã†â€™ÃƒÂ¢Ã¢â€šÂ¬Ã‚Â ÃƒÆ’Ã‚Â¢ÃƒÂ¢Ã¢â‚¬Å¡Ã‚Â¬ÃƒÂ¢Ã¢â‚¬Å¾Ã‚Â¢ÃƒÆ’Ã†â€™Ãƒâ€ Ã¢â‚¬â„¢ÃƒÆ’Ã‚Â¢ÃƒÂ¢Ã¢â‚¬Å¡Ã‚Â¬Ãƒâ€šÃ‚Â¦ÃƒÆ’Ã†â€™ÃƒÂ¢Ã¢â€šÂ¬Ã…Â¡ÃƒÆ’Ã¢â‚¬Å¡Ãƒâ€šÃ‚Â½ÃƒÆ’Ã†â€™Ãƒâ€ Ã¢â‚¬â„¢ÃƒÆ’Ã¢â‚¬Â ÃƒÂ¢Ã¢â€šÂ¬Ã¢â€žÂ¢ÃƒÆ’Ã†â€™Ãƒâ€šÃ‚Â¢ÃƒÆ’Ã‚Â¢ÃƒÂ¢Ã¢â€šÂ¬Ã…Â¡Ãƒâ€šÃ‚Â¬ÃƒÆ’Ã¢â‚¬Â¦Ãƒâ€šÃ‚Â¡ÃƒÆ’Ã†â€™Ãƒâ€ Ã¢â‚¬â„¢ÃƒÆ’Ã‚Â¢ÃƒÂ¢Ã¢â‚¬Å¡Ã‚Â¬Ãƒâ€¦Ã‚Â¡ÃƒÆ’Ã†â€™ÃƒÂ¢Ã¢â€šÂ¬Ã…Â¡ÃƒÆ’Ã¢â‚¬Å¡Ãƒâ€šÃ‚Â¼g</w:t>
+        <w:t>ÃƒÆ’Ã†â€™Ãƒâ€ Ã¢â‚¬â„¢ÃƒÆ’Ã¢â‚¬Â ÃƒÂ¢Ã¢â€šÂ¬Ã¢â€žÂ¢ÃƒÆ’Ã†â€™ÃƒÂ¢Ã¢â€šÂ¬Ã‚Â ÃƒÆ’Ã‚Â¢ÃƒÂ¢Ã¢â‚¬Å¡Ã‚Â¬ÃƒÂ¢Ã¢â‚¬Å¾Ã‚Â¢ÃƒÆ’Ã†â€™Ãƒâ€ Ã¢â‚¬â„¢ÃƒÆ’Ã‚Â¢ÃƒÂ¢Ã¢â‚¬Å¡Ã‚Â¬Ãƒâ€šÃ‚Â ÃƒÆ’Ã†â€™Ãƒâ€šÃ‚Â¢ÃƒÆ’Ã‚Â¢ÃƒÂ¢Ã¢â€šÂ¬Ã…Â¡Ãƒâ€šÃ‚Â¬ÃƒÆ’Ã‚Â¢ÃƒÂ¢Ã¢â€šÂ¬Ã…Â¾Ãƒâ€šÃ‚Â¢ÃƒÆ’Ã†â€™Ãƒâ€ Ã¢â‚¬â„¢ÃƒÆ’Ã¢â‚¬Â ÃƒÂ¢Ã¢â€šÂ¬Ã¢â€žÂ¢ÃƒÆ’Ã†â€™Ãƒâ€šÃ‚Â¢ÃƒÆ’Ã‚Â¢ÃƒÂ¢Ã¢â€šÂ¬Ã…Â¡Ãƒâ€šÃ‚Â¬ÃƒÆ’Ã¢â‚¬Å¡Ãƒâ€šÃ‚Â ÃƒÆ’Ã†â€™Ãƒâ€ Ã¢â‚¬â„¢ÃƒÆ’Ã¢â‚¬Å¡Ãƒâ€šÃ‚Â¢ÃƒÆ’Ã†â€™Ãƒâ€šÃ‚Â¢ÃƒÆ’Ã‚Â¢ÃƒÂ¢Ã¢â‚¬Å¡Ã‚Â¬Ãƒâ€¦Ã‚Â¡ÃƒÆ’Ã¢â‚¬Å¡Ãƒâ€šÃ‚Â¬ÃƒÆ’Ã†â€™Ãƒâ€šÃ‚Â¢ÃƒÆ’Ã‚Â¢ÃƒÂ¢Ã¢â‚¬Å¡Ã‚Â¬Ãƒâ€¦Ã‚Â¾ÃƒÆ’Ã¢â‚¬Å¡Ãƒâ€šÃ‚Â¢ÃƒÆ’Ã†â€™Ãƒâ€ Ã¢â‚¬â„¢ÃƒÆ’Ã¢â‚¬Â ÃƒÂ¢Ã¢â€šÂ¬Ã¢â€žÂ¢ÃƒÆ’Ã†â€™ÃƒÂ¢Ã¢â€šÂ¬Ã‚Â ÃƒÆ’Ã‚Â¢ÃƒÂ¢Ã¢â‚¬Å¡Ã‚Â¬ÃƒÂ¢Ã¢â‚¬Å¾Ã‚Â¢ÃƒÆ’Ã†â€™Ãƒâ€ Ã¢â‚¬â„¢ÃƒÆ’Ã¢â‚¬Å¡Ãƒâ€šÃ‚Â¢ÃƒÆ’Ã†â€™Ãƒâ€šÃ‚Â¢ÃƒÆ’Ã‚Â¢ÃƒÂ¢Ã¢â‚¬Å¡Ã‚Â¬Ãƒâ€¦Ã‚Â¡ÃƒÆ’Ã¢â‚¬Å¡Ãƒâ€šÃ‚Â¬ÃƒÆ’Ã†â€™ÃƒÂ¢Ã¢â€šÂ¬Ã…Â¡ÃƒÆ’Ã¢â‚¬Å¡Ãƒâ€šÃ‚Â¦ÃƒÆ’Ã†â€™Ãƒâ€ Ã¢â‚¬â„¢ÃƒÆ’Ã¢â‚¬Â ÃƒÂ¢Ã¢â€šÂ¬Ã¢â€žÂ¢ÃƒÆ’Ã†â€™Ãƒâ€šÃ‚Â¢ÃƒÆ’Ã‚Â¢ÃƒÂ¢Ã¢â€šÂ¬Ã…Â¡Ãƒâ€šÃ‚Â¬ÃƒÆ’Ã¢â‚¬Â¦Ãƒâ€šÃ‚Â¡ÃƒÆ’Ã†â€™Ãƒâ€ Ã¢â‚¬â„¢ÃƒÆ’Ã‚Â¢ÃƒÂ¢Ã¢â‚¬Å¡Ã‚Â¬Ãƒâ€¦Ã‚Â¡ÃƒÆ’Ã†â€™ÃƒÂ¢Ã¢â€šÂ¬Ã…Â¡ÃƒÆ’Ã¢â‚¬Å¡Ãƒâ€šÃ‚Â½ÃƒÆ’Ã†â€™Ãƒâ€ Ã¢â‚¬â„¢ÃƒÆ’Ã¢â‚¬Â ÃƒÂ¢Ã¢â€šÂ¬Ã¢â€žÂ¢ÃƒÆ’Ã†â€™ÃƒÂ¢Ã¢â€šÂ¬Ã‚Â ÃƒÆ’Ã‚Â¢ÃƒÂ¢Ã¢â‚¬Å¡Ã‚Â¬ÃƒÂ¢Ã¢â‚¬Å¾Ã‚Â¢ÃƒÆ’Ã†â€™Ãƒâ€ Ã¢â‚¬â„¢ÃƒÆ’Ã‚Â¢ÃƒÂ¢Ã¢â‚¬Å¡Ã‚Â¬Ãƒâ€šÃ‚Â ÃƒÆ’Ã†â€™Ãƒâ€šÃ‚Â¢ÃƒÆ’Ã‚Â¢ÃƒÂ¢Ã¢â€šÂ¬Ã…Â¡Ãƒâ€šÃ‚Â¬ÃƒÆ’Ã‚Â¢ÃƒÂ¢Ã¢â€šÂ¬Ã…Â¾Ãƒâ€šÃ‚Â¢ÃƒÆ’Ã†â€™Ãƒâ€ Ã¢â‚¬â„¢ÃƒÆ’Ã¢â‚¬Â ÃƒÂ¢Ã¢â€šÂ¬Ã¢â€žÂ¢ÃƒÆ’Ã†â€™ÃƒÂ¢Ã¢â€šÂ¬Ã…Â¡ÃƒÆ’Ã¢â‚¬Å¡Ãƒâ€šÃ‚Â¢ÃƒÆ’Ã†â€™Ãƒâ€ Ã¢â‚¬â„¢ÃƒÆ’Ã¢â‚¬Å¡Ãƒâ€šÃ‚Â¢ÃƒÆ’Ã†â€™Ãƒâ€šÃ‚Â¢ÃƒÆ’Ã‚Â¢ÃƒÂ¢Ã¢â€šÂ¬Ã…Â¡Ãƒâ€šÃ‚Â¬ÃƒÆ’Ã¢â‚¬Â¦Ãƒâ€šÃ‚Â¡ÃƒÆ’Ã†â€™ÃƒÂ¢Ã¢â€šÂ¬Ã…Â¡ÃƒÆ’Ã¢â‚¬Å¡Ãƒâ€šÃ‚Â¬ÃƒÆ’Ã†â€™Ãƒâ€ Ã¢â‚¬â„¢ÃƒÆ’Ã‚Â¢ÃƒÂ¢Ã¢â‚¬Å¡Ã‚Â¬Ãƒâ€šÃ‚Â¦ÃƒÆ’Ã†â€™ÃƒÂ¢Ã¢â€šÂ¬Ã…Â¡ÃƒÆ’Ã¢â‚¬Å¡Ãƒâ€šÃ‚Â¡ÃƒÆ’Ã†â€™Ãƒâ€ Ã¢â‚¬â„¢ÃƒÆ’Ã¢â‚¬Â ÃƒÂ¢Ã¢â€šÂ¬Ã¢â€žÂ¢ÃƒÆ’Ã†â€™ÃƒÂ¢Ã¢â€šÂ¬Ã‚Â ÃƒÆ’Ã‚Â¢ÃƒÂ¢Ã¢â‚¬Å¡Ã‚Â¬ÃƒÂ¢Ã¢â‚¬Å¾Ã‚Â¢ÃƒÆ’Ã†â€™Ãƒâ€ Ã¢â‚¬â„¢ÃƒÆ’Ã¢â‚¬Å¡Ãƒâ€šÃ‚Â¢ÃƒÆ’Ã†â€™Ãƒâ€šÃ‚Â¢ÃƒÆ’Ã‚Â¢ÃƒÂ¢Ã¢â‚¬Å¡Ã‚Â¬Ãƒâ€¦Ã‚Â¡ÃƒÆ’Ã¢â‚¬Å¡Ãƒâ€šÃ‚Â¬ÃƒÆ’Ã†â€™ÃƒÂ¢Ã¢â€šÂ¬Ã‚Â¦ÃƒÆ’Ã¢â‚¬Å¡Ãƒâ€šÃ‚Â¡ÃƒÆ’Ã†â€™Ãƒâ€ Ã¢â‚¬â„¢ÃƒÆ’Ã¢â‚¬Â ÃƒÂ¢Ã¢â€šÂ¬Ã¢â€žÂ¢ÃƒÆ’Ã†â€™Ãƒâ€šÃ‚Â¢ÃƒÆ’Ã‚Â¢ÃƒÂ¢Ã¢â€šÂ¬Ã…Â¡Ãƒâ€šÃ‚Â¬ÃƒÆ’Ã¢â‚¬Â¦Ãƒâ€šÃ‚Â¡ÃƒÆ’Ã†â€™Ãƒâ€ Ã¢â‚¬â„¢ÃƒÆ’Ã‚Â¢ÃƒÂ¢Ã¢â‚¬Å¡Ã‚Â¬Ãƒâ€¦Ã‚Â¡ÃƒÆ’Ã†â€™ÃƒÂ¢Ã¢â€šÂ¬Ã…Â¡ÃƒÆ’Ã¢â‚¬Å¡Ãƒâ€šÃ‚Â¼g</w:t>
       </w:r>
       <w:proofErr w:type="spellEnd"/>
       <w:r>
@@ -8276,7 +8276,7 @@
           <w:sz w:val="28"/>
           <w:szCs w:val="28"/>
         </w:rPr>
-        <w:t>ÃƒÆ’Ã†â€™Ãƒâ€ Ã¢â‚¬â„¢ÃƒÆ’Ã¢â‚¬Â ÃƒÂ¢Ã¢â€šÂ¬Ã¢â€žÂ¢ÃƒÆ’Ã†â€™ÃƒÂ¢Ã¢â€šÂ¬Ã‚Â ÃƒÆ’Ã‚Â¢ÃƒÂ¢Ã¢â‚¬Å¡Ã‚Â¬ÃƒÂ¢Ã¢â‚¬Å¾Ã‚Â¢ÃƒÆ’Ã†â€™Ãƒâ€ Ã¢â‚¬â„¢ÃƒÆ’Ã‚Â¢ÃƒÂ¢Ã¢â‚¬Å¡Ã‚Â¬Ãƒâ€šÃ‚Â¦ÃƒÆ’Ã†â€™ÃƒÂ¢Ã¢â€šÂ¬Ã…Â¡ÃƒÆ’Ã¢â‚¬Å¡Ãƒâ€šÃ‚Â½ÃƒÆ’Ã†â€™Ãƒâ€ Ã¢â‚¬â„¢ÃƒÆ’Ã¢â‚¬Â ÃƒÂ¢Ã¢â€šÂ¬Ã¢â€žÂ¢ÃƒÆ’Ã†â€™Ãƒâ€šÃ‚Â¢ÃƒÆ’Ã‚Â¢ÃƒÂ¢Ã¢â€šÂ¬Ã…Â¡Ãƒâ€šÃ‚Â¬ÃƒÆ’Ã¢â‚¬Â¦Ãƒâ€šÃ‚Â¡ÃƒÆ’Ã†â€™Ãƒâ€ Ã¢â‚¬â„¢ÃƒÆ’Ã‚Â¢ÃƒÂ¢Ã¢â‚¬Å¡Ã‚Â¬Ãƒâ€¦Ã‚Â¡ÃƒÆ’Ã†â€™ÃƒÂ¢Ã¢â€šÂ¬Ã…Â¡ÃƒÆ’Ã¢â‚¬Å¡Ãƒâ€šÃ‚Â¼g</w:t>
+        <w:t>ÃƒÆ’Ã†â€™Ãƒâ€ Ã¢â‚¬â„¢ÃƒÆ’Ã¢â‚¬Â ÃƒÂ¢Ã¢â€šÂ¬Ã¢â€žÂ¢ÃƒÆ’Ã†â€™ÃƒÂ¢Ã¢â€šÂ¬Ã‚Â ÃƒÆ’Ã‚Â¢ÃƒÂ¢Ã¢â‚¬Å¡Ã‚Â¬ÃƒÂ¢Ã¢â‚¬Å¾Ã‚Â¢ÃƒÆ’Ã†â€™Ãƒâ€ Ã¢â‚¬â„¢ÃƒÆ’Ã‚Â¢ÃƒÂ¢Ã¢â‚¬Å¡Ã‚Â¬Ãƒâ€šÃ‚Â ÃƒÆ’Ã†â€™Ãƒâ€šÃ‚Â¢ÃƒÆ’Ã‚Â¢ÃƒÂ¢Ã¢â€šÂ¬Ã…Â¡Ãƒâ€šÃ‚Â¬ÃƒÆ’Ã‚Â¢ÃƒÂ¢Ã¢â€šÂ¬Ã…Â¾Ãƒâ€šÃ‚Â¢ÃƒÆ’Ã†â€™Ãƒâ€ Ã¢â‚¬â„¢ÃƒÆ’Ã¢â‚¬Â ÃƒÂ¢Ã¢â€šÂ¬Ã¢â€žÂ¢ÃƒÆ’Ã†â€™Ãƒâ€šÃ‚Â¢ÃƒÆ’Ã‚Â¢ÃƒÂ¢Ã¢â€šÂ¬Ã…Â¡Ãƒâ€šÃ‚Â¬ÃƒÆ’Ã¢â‚¬Å¡Ãƒâ€šÃ‚Â ÃƒÆ’Ã†â€™Ãƒâ€ Ã¢â‚¬â„¢ÃƒÆ’Ã¢â‚¬Å¡Ãƒâ€šÃ‚Â¢ÃƒÆ’Ã†â€™Ãƒâ€šÃ‚Â¢ÃƒÆ’Ã‚Â¢ÃƒÂ¢Ã¢â‚¬Å¡Ã‚Â¬Ãƒâ€¦Ã‚Â¡ÃƒÆ’Ã¢â‚¬Å¡Ãƒâ€šÃ‚Â¬ÃƒÆ’Ã†â€™Ãƒâ€šÃ‚Â¢ÃƒÆ’Ã‚Â¢ÃƒÂ¢Ã¢â‚¬Å¡Ã‚Â¬Ãƒâ€¦Ã‚Â¾ÃƒÆ’Ã¢â‚¬Å¡Ãƒâ€šÃ‚Â¢ÃƒÆ’Ã†â€™Ãƒâ€ Ã¢â‚¬â„¢ÃƒÆ’Ã¢â‚¬Â ÃƒÂ¢Ã¢â€šÂ¬Ã¢â€žÂ¢ÃƒÆ’Ã†â€™ÃƒÂ¢Ã¢â€šÂ¬Ã‚Â ÃƒÆ’Ã‚Â¢ÃƒÂ¢Ã¢â‚¬Å¡Ã‚Â¬ÃƒÂ¢Ã¢â‚¬Å¾Ã‚Â¢ÃƒÆ’Ã†â€™Ãƒâ€ Ã¢â‚¬â„¢ÃƒÆ’Ã¢â‚¬Å¡Ãƒâ€šÃ‚Â¢ÃƒÆ’Ã†â€™Ãƒâ€šÃ‚Â¢ÃƒÆ’Ã‚Â¢ÃƒÂ¢Ã¢â‚¬Å¡Ã‚Â¬Ãƒâ€¦Ã‚Â¡ÃƒÆ’Ã¢â‚¬Å¡Ãƒâ€šÃ‚Â¬ÃƒÆ’Ã†â€™ÃƒÂ¢Ã¢â€šÂ¬Ã…Â¡ÃƒÆ’Ã¢â‚¬Å¡Ãƒâ€šÃ‚Â¦ÃƒÆ’Ã†â€™Ãƒâ€ Ã¢â‚¬â„¢ÃƒÆ’Ã¢â‚¬Â ÃƒÂ¢Ã¢â€šÂ¬Ã¢â€žÂ¢ÃƒÆ’Ã†â€™Ãƒâ€šÃ‚Â¢ÃƒÆ’Ã‚Â¢ÃƒÂ¢Ã¢â€šÂ¬Ã…Â¡Ãƒâ€šÃ‚Â¬ÃƒÆ’Ã¢â‚¬Â¦Ãƒâ€šÃ‚Â¡ÃƒÆ’Ã†â€™Ãƒâ€ Ã¢â‚¬â„¢ÃƒÆ’Ã‚Â¢ÃƒÂ¢Ã¢â‚¬Å¡Ã‚Â¬Ãƒâ€¦Ã‚Â¡ÃƒÆ’Ã†â€™ÃƒÂ¢Ã¢â€šÂ¬Ã…Â¡ÃƒÆ’Ã¢â‚¬Å¡Ãƒâ€šÃ‚Â½ÃƒÆ’Ã†â€™Ãƒâ€ Ã¢â‚¬â„¢ÃƒÆ’Ã¢â‚¬Â ÃƒÂ¢Ã¢â€šÂ¬Ã¢â€žÂ¢ÃƒÆ’Ã†â€™ÃƒÂ¢Ã¢â€šÂ¬Ã‚Â ÃƒÆ’Ã‚Â¢ÃƒÂ¢Ã¢â‚¬Å¡Ã‚Â¬ÃƒÂ¢Ã¢â‚¬Å¾Ã‚Â¢ÃƒÆ’Ã†â€™Ãƒâ€ Ã¢â‚¬â„¢ÃƒÆ’Ã‚Â¢ÃƒÂ¢Ã¢â‚¬Å¡Ã‚Â¬Ãƒâ€šÃ‚Â ÃƒÆ’Ã†â€™Ãƒâ€šÃ‚Â¢ÃƒÆ’Ã‚Â¢ÃƒÂ¢Ã¢â€šÂ¬Ã…Â¡Ãƒâ€šÃ‚Â¬ÃƒÆ’Ã‚Â¢ÃƒÂ¢Ã¢â€šÂ¬Ã…Â¾Ãƒâ€šÃ‚Â¢ÃƒÆ’Ã†â€™Ãƒâ€ Ã¢â‚¬â„¢ÃƒÆ’Ã¢â‚¬Â ÃƒÂ¢Ã¢â€šÂ¬Ã¢â€žÂ¢ÃƒÆ’Ã†â€™ÃƒÂ¢Ã¢â€šÂ¬Ã…Â¡ÃƒÆ’Ã¢â‚¬Å¡Ãƒâ€šÃ‚Â¢ÃƒÆ’Ã†â€™Ãƒâ€ Ã¢â‚¬â„¢ÃƒÆ’Ã¢â‚¬Å¡Ãƒâ€šÃ‚Â¢ÃƒÆ’Ã†â€™Ãƒâ€šÃ‚Â¢ÃƒÆ’Ã‚Â¢ÃƒÂ¢Ã¢â€šÂ¬Ã…Â¡Ãƒâ€šÃ‚Â¬ÃƒÆ’Ã¢â‚¬Â¦Ãƒâ€šÃ‚Â¡ÃƒÆ’Ã†â€™ÃƒÂ¢Ã¢â€šÂ¬Ã…Â¡ÃƒÆ’Ã¢â‚¬Å¡Ãƒâ€šÃ‚Â¬ÃƒÆ’Ã†â€™Ãƒâ€ Ã¢â‚¬â„¢ÃƒÆ’Ã‚Â¢ÃƒÂ¢Ã¢â‚¬Å¡Ã‚Â¬Ãƒâ€šÃ‚Â¦ÃƒÆ’Ã†â€™ÃƒÂ¢Ã¢â€šÂ¬Ã…Â¡ÃƒÆ’Ã¢â‚¬Å¡Ãƒâ€šÃ‚Â¡ÃƒÆ’Ã†â€™Ãƒâ€ Ã¢â‚¬â„¢ÃƒÆ’Ã¢â‚¬Â ÃƒÂ¢Ã¢â€šÂ¬Ã¢â€žÂ¢ÃƒÆ’Ã†â€™ÃƒÂ¢Ã¢â€šÂ¬Ã‚Â ÃƒÆ’Ã‚Â¢ÃƒÂ¢Ã¢â‚¬Å¡Ã‚Â¬ÃƒÂ¢Ã¢â‚¬Å¾Ã‚Â¢ÃƒÆ’Ã†â€™Ãƒâ€ Ã¢â‚¬â„¢ÃƒÆ’Ã¢â‚¬Å¡Ãƒâ€šÃ‚Â¢ÃƒÆ’Ã†â€™Ãƒâ€šÃ‚Â¢ÃƒÆ’Ã‚Â¢ÃƒÂ¢Ã¢â‚¬Å¡Ã‚Â¬Ãƒâ€¦Ã‚Â¡ÃƒÆ’Ã¢â‚¬Å¡Ãƒâ€šÃ‚Â¬ÃƒÆ’Ã†â€™ÃƒÂ¢Ã¢â€šÂ¬Ã‚Â¦ÃƒÆ’Ã¢â‚¬Å¡Ãƒâ€šÃ‚Â¡ÃƒÆ’Ã†â€™Ãƒâ€ Ã¢â‚¬â„¢ÃƒÆ’Ã¢â‚¬Â ÃƒÂ¢Ã¢â€šÂ¬Ã¢â€žÂ¢ÃƒÆ’Ã†â€™Ãƒâ€šÃ‚Â¢ÃƒÆ’Ã‚Â¢ÃƒÂ¢Ã¢â€šÂ¬Ã…Â¡Ãƒâ€šÃ‚Â¬ÃƒÆ’Ã¢â‚¬Â¦Ãƒâ€šÃ‚Â¡ÃƒÆ’Ã†â€™Ãƒâ€ Ã¢â‚¬â„¢ÃƒÆ’Ã‚Â¢ÃƒÂ¢Ã¢â‚¬Å¡Ã‚Â¬Ãƒâ€¦Ã‚Â¡ÃƒÆ’Ã†â€™ÃƒÂ¢Ã¢â€šÂ¬Ã…Â¡ÃƒÆ’Ã¢â‚¬Å¡Ãƒâ€šÃ‚Â¼g</w:t>
       </w:r>
       <w:proofErr w:type="spellEnd"/>
       <w:r>
@@ -8406,7 +8406,7 @@
           <w:szCs w:val="28"/>
         </w:rPr>
         <w:lastRenderedPageBreak/>
-        <w:t xml:space="preserve">By Week 7, sodium nitrite concentrations in both treatments had declined and stabilized at very similar levels, approximately 73ÃƒÆ’Ã†â€™Ãƒâ€ Ã¢â‚¬â„¢ÃƒÆ’Ã¢â‚¬Â ÃƒÂ¢Ã¢â€šÂ¬Ã¢â€žÂ¢ÃƒÆ’Ã†â€™ÃƒÂ¢Ã¢â€šÂ¬Ã‚Â ÃƒÆ’Ã‚Â¢ÃƒÂ¢Ã¢â‚¬Å¡Ã‚Â¬ÃƒÂ¢Ã¢â‚¬Å¾Ã‚Â¢ÃƒÆ’Ã†â€™Ãƒâ€ Ã¢â‚¬â„¢ÃƒÆ’Ã‚Â¢ÃƒÂ¢Ã¢â‚¬Å¡Ã‚Â¬Ãƒâ€¦Ã‚Â¡ÃƒÆ’Ã†â€™ÃƒÂ¢Ã¢â€šÂ¬Ã…Â¡ÃƒÆ’Ã¢â‚¬Å¡Ãƒâ€šÃ‚Â¢ÃƒÆ’Ã†â€™Ãƒâ€ Ã¢â‚¬â„¢ÃƒÆ’Ã¢â‚¬Â ÃƒÂ¢Ã¢â€šÂ¬Ã¢â€žÂ¢ÃƒÆ’Ã†â€™ÃƒÂ¢Ã¢â€šÂ¬Ã…Â¡ÃƒÆ’Ã¢â‚¬Å¡Ãƒâ€šÃ‚Â¢ÃƒÆ’Ã†â€™Ãƒâ€ Ã¢â‚¬â„¢ÃƒÆ’Ã¢â‚¬Å¡Ãƒâ€šÃ‚Â¢ÃƒÆ’Ã†â€™Ãƒâ€šÃ‚Â¢ÃƒÆ’Ã‚Â¢ÃƒÂ¢Ã¢â‚¬Å¡Ã‚Â¬Ãƒâ€¦Ã‚Â¡ÃƒÆ’Ã¢â‚¬Å¡Ãƒâ€šÃ‚Â¬ÃƒÆ’Ã†â€™ÃƒÂ¢Ã¢â€šÂ¬Ã‚Â¦ÃƒÆ’Ã¢â‚¬Å¡Ãƒâ€šÃ‚Â¡ÃƒÆ’Ã†â€™Ãƒâ€ Ã¢â‚¬â„¢ÃƒÆ’Ã‚Â¢ÃƒÂ¢Ã¢â‚¬Å¡Ã‚Â¬Ãƒâ€¦Ã‚Â¡ÃƒÆ’Ã†â€™ÃƒÂ¢Ã¢â€šÂ¬Ã…Â¡ÃƒÆ’Ã¢â‚¬Å¡Ãƒâ€šÃ‚Â¬ÃƒÆ’Ã†â€™Ãƒâ€ Ã¢â‚¬â„¢ÃƒÆ’Ã¢â‚¬Â ÃƒÂ¢Ã¢â€šÂ¬Ã¢â€žÂ¢ÃƒÆ’Ã†â€™ÃƒÂ¢Ã¢â€šÂ¬Ã…Â¡ÃƒÆ’Ã¢â‚¬Å¡Ãƒâ€šÃ‚Â¢ÃƒÆ’Ã†â€™Ãƒâ€ Ã¢â‚¬â„¢ÃƒÆ’Ã¢â‚¬Å¡Ãƒâ€šÃ‚Â¢ÃƒÆ’Ã†â€™Ãƒâ€šÃ‚Â¢ÃƒÆ’Ã‚Â¢ÃƒÂ¢Ã¢â€šÂ¬Ã…Â¡Ãƒâ€šÃ‚Â¬ÃƒÆ’Ã¢â‚¬Â¦Ãƒâ€šÃ‚Â¡ÃƒÆ’Ã†â€™ÃƒÂ¢Ã¢â€šÂ¬Ã…Â¡ÃƒÆ’Ã¢â‚¬Å¡Ãƒâ€šÃ‚Â¬ÃƒÆ’Ã†â€™Ãƒâ€ Ã¢â‚¬â„¢ÃƒÆ’Ã‚Â¢ÃƒÂ¢Ã¢â‚¬Å¡Ã‚Â¬Ãƒâ€šÃ‚Â¦ÃƒÆ’Ã†â€™Ãƒâ€šÃ‚Â¢ÃƒÆ’Ã‚Â¢ÃƒÂ¢Ã¢â€šÂ¬Ã…Â¡Ãƒâ€šÃ‚Â¬ÃƒÆ’Ã¢â‚¬Â¦ÃƒÂ¢Ã¢â€šÂ¬Ã…â€œ74 </w:t>
+        <w:t xml:space="preserve">By Week 7, sodium nitrite concentrations in both treatments had declined and stabilized at very similar levels, approximately 73ÃƒÆ’Ã†â€™Ãƒâ€ Ã¢â‚¬â„¢ÃƒÆ’Ã¢â‚¬Â ÃƒÂ¢Ã¢â€šÂ¬Ã¢â€žÂ¢ÃƒÆ’Ã†â€™ÃƒÂ¢Ã¢â€šÂ¬Ã‚Â ÃƒÆ’Ã‚Â¢ÃƒÂ¢Ã¢â‚¬Å¡Ã‚Â¬ÃƒÂ¢Ã¢â‚¬Å¾Ã‚Â¢ÃƒÆ’Ã†â€™Ãƒâ€ Ã¢â‚¬â„¢ÃƒÆ’Ã‚Â¢ÃƒÂ¢Ã¢â‚¬Å¡Ã‚Â¬Ãƒâ€šÃ‚Â ÃƒÆ’Ã†â€™Ãƒâ€šÃ‚Â¢ÃƒÆ’Ã‚Â¢ÃƒÂ¢Ã¢â€šÂ¬Ã…Â¡Ãƒâ€šÃ‚Â¬ÃƒÆ’Ã‚Â¢ÃƒÂ¢Ã¢â€šÂ¬Ã…Â¾Ãƒâ€šÃ‚Â¢ÃƒÆ’Ã†â€™Ãƒâ€ Ã¢â‚¬â„¢ÃƒÆ’Ã¢â‚¬Â ÃƒÂ¢Ã¢â€šÂ¬Ã¢â€žÂ¢ÃƒÆ’Ã†â€™Ãƒâ€šÃ‚Â¢ÃƒÆ’Ã‚Â¢ÃƒÂ¢Ã¢â€šÂ¬Ã…Â¡Ãƒâ€šÃ‚Â¬ÃƒÆ’Ã¢â‚¬Å¡Ãƒâ€šÃ‚Â ÃƒÆ’Ã†â€™Ãƒâ€ Ã¢â‚¬â„¢ÃƒÆ’Ã¢â‚¬Å¡Ãƒâ€šÃ‚Â¢ÃƒÆ’Ã†â€™Ãƒâ€šÃ‚Â¢ÃƒÆ’Ã‚Â¢ÃƒÂ¢Ã¢â‚¬Å¡Ã‚Â¬Ãƒâ€¦Ã‚Â¡ÃƒÆ’Ã¢â‚¬Å¡Ãƒâ€šÃ‚Â¬ÃƒÆ’Ã†â€™Ãƒâ€šÃ‚Â¢ÃƒÆ’Ã‚Â¢ÃƒÂ¢Ã¢â‚¬Å¡Ã‚Â¬Ãƒâ€¦Ã‚Â¾ÃƒÆ’Ã¢â‚¬Å¡Ãƒâ€šÃ‚Â¢ÃƒÆ’Ã†â€™Ãƒâ€ Ã¢â‚¬â„¢ÃƒÆ’Ã¢â‚¬Â ÃƒÂ¢Ã¢â€šÂ¬Ã¢â€žÂ¢ÃƒÆ’Ã†â€™ÃƒÂ¢Ã¢â€šÂ¬Ã‚Â ÃƒÆ’Ã‚Â¢ÃƒÂ¢Ã¢â‚¬Å¡Ã‚Â¬ÃƒÂ¢Ã¢â‚¬Å¾Ã‚Â¢ÃƒÆ’Ã†â€™Ãƒâ€ Ã¢â‚¬â„¢ÃƒÆ’Ã¢â‚¬Å¡Ãƒâ€šÃ‚Â¢ÃƒÆ’Ã†â€™Ãƒâ€šÃ‚Â¢ÃƒÆ’Ã‚Â¢ÃƒÂ¢Ã¢â‚¬Å¡Ã‚Â¬Ãƒâ€¦Ã‚Â¡ÃƒÆ’Ã¢â‚¬Å¡Ãƒâ€šÃ‚Â¬ÃƒÆ’Ã†â€™ÃƒÂ¢Ã¢â€šÂ¬Ã‚Â¦ÃƒÆ’Ã¢â‚¬Å¡Ãƒâ€šÃ‚Â¡ÃƒÆ’Ã†â€™Ãƒâ€ Ã¢â‚¬â„¢ÃƒÆ’Ã¢â‚¬Â ÃƒÂ¢Ã¢â€šÂ¬Ã¢â€žÂ¢ÃƒÆ’Ã†â€™Ãƒâ€šÃ‚Â¢ÃƒÆ’Ã‚Â¢ÃƒÂ¢Ã¢â€šÂ¬Ã…Â¡Ãƒâ€šÃ‚Â¬ÃƒÆ’Ã¢â‚¬Â¦Ãƒâ€šÃ‚Â¡ÃƒÆ’Ã†â€™Ãƒâ€ Ã¢â‚¬â„¢ÃƒÆ’Ã‚Â¢ÃƒÂ¢Ã¢â‚¬Å¡Ã‚Â¬Ãƒâ€¦Ã‚Â¡ÃƒÆ’Ã†â€™ÃƒÂ¢Ã¢â€šÂ¬Ã…Â¡ÃƒÆ’Ã¢â‚¬Å¡Ãƒâ€šÃ‚Â¢ÃƒÆ’Ã†â€™Ãƒâ€ Ã¢â‚¬â„¢ÃƒÆ’Ã¢â‚¬Â ÃƒÂ¢Ã¢â€šÂ¬Ã¢â€žÂ¢ÃƒÆ’Ã†â€™ÃƒÂ¢Ã¢â€šÂ¬Ã‚Â ÃƒÆ’Ã‚Â¢ÃƒÂ¢Ã¢â‚¬Å¡Ã‚Â¬ÃƒÂ¢Ã¢â‚¬Å¾Ã‚Â¢ÃƒÆ’Ã†â€™Ãƒâ€ Ã¢â‚¬â„¢ÃƒÆ’Ã‚Â¢ÃƒÂ¢Ã¢â‚¬Å¡Ã‚Â¬Ãƒâ€šÃ‚Â ÃƒÆ’Ã†â€™Ãƒâ€šÃ‚Â¢ÃƒÆ’Ã‚Â¢ÃƒÂ¢Ã¢â€šÂ¬Ã…Â¡Ãƒâ€šÃ‚Â¬ÃƒÆ’Ã‚Â¢ÃƒÂ¢Ã¢â€šÂ¬Ã…Â¾Ãƒâ€šÃ‚Â¢ÃƒÆ’Ã†â€™Ãƒâ€ Ã¢â‚¬â„¢ÃƒÆ’Ã¢â‚¬Â ÃƒÂ¢Ã¢â€šÂ¬Ã¢â€žÂ¢ÃƒÆ’Ã†â€™Ãƒâ€šÃ‚Â¢ÃƒÆ’Ã‚Â¢ÃƒÂ¢Ã¢â€šÂ¬Ã…Â¡Ãƒâ€šÃ‚Â¬ÃƒÆ’Ã¢â‚¬Â¦Ãƒâ€šÃ‚Â¡ÃƒÆ’Ã†â€™Ãƒâ€ Ã¢â‚¬â„¢ÃƒÆ’Ã‚Â¢ÃƒÂ¢Ã¢â‚¬Å¡Ã‚Â¬Ãƒâ€¦Ã‚Â¡ÃƒÆ’Ã†â€™ÃƒÂ¢Ã¢â€šÂ¬Ã…Â¡ÃƒÆ’Ã¢â‚¬Å¡Ãƒâ€šÃ‚Â¢ÃƒÆ’Ã†â€™Ãƒâ€ Ã¢â‚¬â„¢ÃƒÆ’Ã¢â‚¬Â ÃƒÂ¢Ã¢â€šÂ¬Ã¢â€žÂ¢ÃƒÆ’Ã†â€™ÃƒÂ¢Ã¢â€šÂ¬Ã‚Â ÃƒÆ’Ã‚Â¢ÃƒÂ¢Ã¢â‚¬Å¡Ã‚Â¬ÃƒÂ¢Ã¢â‚¬Å¾Ã‚Â¢ÃƒÆ’Ã†â€™Ãƒâ€ Ã¢â‚¬â„¢ÃƒÆ’Ã‚Â¢ÃƒÂ¢Ã¢â‚¬Å¡Ã‚Â¬Ãƒâ€¦Ã‚Â¡ÃƒÆ’Ã†â€™ÃƒÂ¢Ã¢â€šÂ¬Ã…Â¡ÃƒÆ’Ã¢â‚¬Å¡Ãƒâ€šÃ‚Â¢ÃƒÆ’Ã†â€™Ãƒâ€ Ã¢â‚¬â„¢ÃƒÆ’Ã¢â‚¬Â ÃƒÂ¢Ã¢â€šÂ¬Ã¢â€žÂ¢ÃƒÆ’Ã†â€™ÃƒÂ¢Ã¢â€šÂ¬Ã…Â¡ÃƒÆ’Ã¢â‚¬Å¡Ãƒâ€šÃ‚Â¢ÃƒÆ’Ã†â€™Ãƒâ€ Ã¢â‚¬â„¢ÃƒÆ’Ã¢â‚¬Å¡Ãƒâ€šÃ‚Â¢ÃƒÆ’Ã†â€™Ãƒâ€šÃ‚Â¢ÃƒÆ’Ã‚Â¢ÃƒÂ¢Ã¢â‚¬Å¡Ã‚Â¬Ãƒâ€¦Ã‚Â¡ÃƒÆ’Ã¢â‚¬Å¡Ãƒâ€šÃ‚Â¬ÃƒÆ’Ã†â€™ÃƒÂ¢Ã¢â€šÂ¬Ã‚Â¦ÃƒÆ’Ã¢â‚¬Å¡Ãƒâ€šÃ‚Â¡ÃƒÆ’Ã†â€™Ãƒâ€ Ã¢â‚¬â„¢ÃƒÆ’Ã‚Â¢ÃƒÂ¢Ã¢â‚¬Å¡Ã‚Â¬Ãƒâ€¦Ã‚Â¡ÃƒÆ’Ã†â€™ÃƒÂ¢Ã¢â€šÂ¬Ã…Â¡ÃƒÆ’Ã¢â‚¬Å¡Ãƒâ€šÃ‚Â¬ÃƒÆ’Ã†â€™Ãƒâ€ Ã¢â‚¬â„¢ÃƒÆ’Ã¢â‚¬Â ÃƒÂ¢Ã¢â€šÂ¬Ã¢â€žÂ¢ÃƒÆ’Ã†â€™Ãƒâ€šÃ‚Â¢ÃƒÆ’Ã‚Â¢ÃƒÂ¢Ã¢â€šÂ¬Ã…Â¡Ãƒâ€šÃ‚Â¬ÃƒÆ’Ã¢â‚¬Å¡Ãƒâ€šÃ‚Â¦ÃƒÆ’Ã†â€™Ãƒâ€ Ã¢â‚¬â„¢ÃƒÆ’Ã‚Â¢ÃƒÂ¢Ã¢â‚¬Å¡Ã‚Â¬Ãƒâ€¦Ã‚Â¡ÃƒÆ’Ã†â€™ÃƒÂ¢Ã¢â€šÂ¬Ã…Â¡ÃƒÆ’Ã¢â‚¬Å¡Ãƒâ€šÃ‚Â¡ÃƒÆ’Ã†â€™Ãƒâ€ Ã¢â‚¬â„¢ÃƒÆ’Ã¢â‚¬Â ÃƒÂ¢Ã¢â€šÂ¬Ã¢â€žÂ¢ÃƒÆ’Ã†â€™ÃƒÂ¢Ã¢â€šÂ¬Ã‚Â ÃƒÆ’Ã‚Â¢ÃƒÂ¢Ã¢â‚¬Å¡Ã‚Â¬ÃƒÂ¢Ã¢â‚¬Å¾Ã‚Â¢ÃƒÆ’Ã†â€™Ãƒâ€ Ã¢â‚¬â„¢ÃƒÆ’Ã¢â‚¬Å¡Ãƒâ€šÃ‚Â¢ÃƒÆ’Ã†â€™Ãƒâ€šÃ‚Â¢ÃƒÆ’Ã‚Â¢ÃƒÂ¢Ã¢â‚¬Å¡Ã‚Â¬Ãƒâ€¦Ã‚Â¡ÃƒÆ’Ã¢â‚¬Å¡Ãƒâ€šÃ‚Â¬ÃƒÆ’Ã†â€™ÃƒÂ¢Ã¢â€šÂ¬Ã‚Â¦ÃƒÆ’Ã¢â‚¬Å¡Ãƒâ€šÃ‚Â¡ÃƒÆ’Ã†â€™Ãƒâ€ Ã¢â‚¬â„¢ÃƒÆ’Ã¢â‚¬Â ÃƒÂ¢Ã¢â€šÂ¬Ã¢â€žÂ¢ÃƒÆ’Ã†â€™Ãƒâ€šÃ‚Â¢ÃƒÆ’Ã‚Â¢ÃƒÂ¢Ã¢â€šÂ¬Ã…Â¡Ãƒâ€šÃ‚Â¬ÃƒÆ’Ã¢â‚¬Â¦Ãƒâ€šÃ‚Â¡ÃƒÆ’Ã†â€™Ãƒâ€ Ã¢â‚¬â„¢ÃƒÆ’Ã‚Â¢ÃƒÂ¢Ã¢â‚¬Å¡Ã‚Â¬Ãƒâ€¦Ã‚Â¡ÃƒÆ’Ã†â€™ÃƒÂ¢Ã¢â€šÂ¬Ã…Â¡ÃƒÆ’Ã¢â‚¬Å¡Ãƒâ€šÃ‚Â¬ÃƒÆ’Ã†â€™Ãƒâ€ Ã¢â‚¬â„¢ÃƒÆ’Ã¢â‚¬Â ÃƒÂ¢Ã¢â€šÂ¬Ã¢â€žÂ¢ÃƒÆ’Ã†â€™ÃƒÂ¢Ã¢â€šÂ¬Ã‚Â ÃƒÆ’Ã‚Â¢ÃƒÂ¢Ã¢â‚¬Å¡Ã‚Â¬ÃƒÂ¢Ã¢â‚¬Å¾Ã‚Â¢ÃƒÆ’Ã†â€™Ãƒâ€ Ã¢â‚¬â„¢ÃƒÆ’Ã‚Â¢ÃƒÂ¢Ã¢â‚¬Å¡Ã‚Â¬Ãƒâ€šÃ‚Â ÃƒÆ’Ã†â€™Ãƒâ€šÃ‚Â¢ÃƒÆ’Ã‚Â¢ÃƒÂ¢Ã¢â€šÂ¬Ã…Â¡Ãƒâ€šÃ‚Â¬ÃƒÆ’Ã‚Â¢ÃƒÂ¢Ã¢â€šÂ¬Ã…Â¾Ãƒâ€šÃ‚Â¢ÃƒÆ’Ã†â€™Ãƒâ€ Ã¢â‚¬â„¢ÃƒÆ’Ã¢â‚¬Â ÃƒÂ¢Ã¢â€šÂ¬Ã¢â€žÂ¢ÃƒÆ’Ã†â€™Ãƒâ€šÃ‚Â¢ÃƒÆ’Ã‚Â¢ÃƒÂ¢Ã¢â€šÂ¬Ã…Â¡Ãƒâ€šÃ‚Â¬ÃƒÆ’Ã¢â‚¬Â¦Ãƒâ€šÃ‚Â¡ÃƒÆ’Ã†â€™Ãƒâ€ Ã¢â‚¬â„¢ÃƒÆ’Ã‚Â¢ÃƒÂ¢Ã¢â‚¬Å¡Ã‚Â¬Ãƒâ€¦Ã‚Â¡ÃƒÆ’Ã†â€™ÃƒÂ¢Ã¢â€šÂ¬Ã…Â¡ÃƒÆ’Ã¢â‚¬Å¡Ãƒâ€šÃ‚Â¢ÃƒÆ’Ã†â€™Ãƒâ€ Ã¢â‚¬â„¢ÃƒÆ’Ã¢â‚¬Â ÃƒÂ¢Ã¢â€šÂ¬Ã¢â€žÂ¢ÃƒÆ’Ã†â€™ÃƒÂ¢Ã¢â€šÂ¬Ã‚Â ÃƒÆ’Ã‚Â¢ÃƒÂ¢Ã¢â‚¬Å¡Ã‚Â¬ÃƒÂ¢Ã¢â‚¬Å¾Ã‚Â¢ÃƒÆ’Ã†â€™Ãƒâ€ Ã¢â‚¬â„¢ÃƒÆ’Ã‚Â¢ÃƒÂ¢Ã¢â‚¬Å¡Ã‚Â¬Ãƒâ€¦Ã‚Â¡ÃƒÆ’Ã†â€™ÃƒÂ¢Ã¢â€šÂ¬Ã…Â¡ÃƒÆ’Ã¢â‚¬Å¡Ãƒâ€šÃ‚Â¢ÃƒÆ’Ã†â€™Ãƒâ€ Ã¢â‚¬â„¢ÃƒÆ’Ã¢â‚¬Â ÃƒÂ¢Ã¢â€šÂ¬Ã¢â€žÂ¢ÃƒÆ’Ã†â€™ÃƒÂ¢Ã¢â€šÂ¬Ã…Â¡ÃƒÆ’Ã¢â‚¬Å¡Ãƒâ€šÃ‚Â¢ÃƒÆ’Ã†â€™Ãƒâ€ Ã¢â‚¬â„¢ÃƒÆ’Ã¢â‚¬Å¡Ãƒâ€šÃ‚Â¢ÃƒÆ’Ã†â€™Ãƒâ€šÃ‚Â¢ÃƒÆ’Ã‚Â¢ÃƒÂ¢Ã¢â€šÂ¬Ã…Â¡Ãƒâ€šÃ‚Â¬ÃƒÆ’Ã¢â‚¬Â¦Ãƒâ€šÃ‚Â¡ÃƒÆ’Ã†â€™ÃƒÂ¢Ã¢â€šÂ¬Ã…Â¡ÃƒÆ’Ã¢â‚¬Å¡Ãƒâ€šÃ‚Â¬ÃƒÆ’Ã†â€™Ãƒâ€ Ã¢â‚¬â„¢ÃƒÆ’Ã‚Â¢ÃƒÂ¢Ã¢â‚¬Å¡Ã‚Â¬Ãƒâ€šÃ‚Â¦ÃƒÆ’Ã†â€™ÃƒÂ¢Ã¢â€šÂ¬Ã…Â¡ÃƒÆ’Ã¢â‚¬Å¡Ãƒâ€šÃ‚Â¡ÃƒÆ’Ã†â€™Ãƒâ€ Ã¢â‚¬â„¢ÃƒÆ’Ã¢â‚¬Â ÃƒÂ¢Ã¢â€šÂ¬Ã¢â€žÂ¢ÃƒÆ’Ã†â€™Ãƒâ€šÃ‚Â¢ÃƒÆ’Ã‚Â¢ÃƒÂ¢Ã¢â€šÂ¬Ã…Â¡Ãƒâ€šÃ‚Â¬ÃƒÆ’Ã¢â‚¬Â¦Ãƒâ€šÃ‚Â¡ÃƒÆ’Ã†â€™Ãƒâ€ Ã¢â‚¬â„¢ÃƒÆ’Ã‚Â¢ÃƒÂ¢Ã¢â‚¬Å¡Ã‚Â¬Ãƒâ€¦Ã‚Â¡ÃƒÆ’Ã†â€™ÃƒÂ¢Ã¢â€šÂ¬Ã…Â¡ÃƒÆ’Ã¢â‚¬Å¡Ãƒâ€šÃ‚Â¬ÃƒÆ’Ã†â€™Ãƒâ€ Ã¢â‚¬â„¢ÃƒÆ’Ã¢â‚¬Â ÃƒÂ¢Ã¢â€šÂ¬Ã¢â€žÂ¢ÃƒÆ’Ã†â€™ÃƒÂ¢Ã¢â€šÂ¬Ã‚Â ÃƒÆ’Ã‚Â¢ÃƒÂ¢Ã¢â‚¬Å¡Ã‚Â¬ÃƒÂ¢Ã¢â‚¬Å¾Ã‚Â¢ÃƒÆ’Ã†â€™Ãƒâ€ Ã¢â‚¬â„¢ÃƒÆ’Ã¢â‚¬Å¡Ãƒâ€šÃ‚Â¢ÃƒÆ’Ã†â€™Ãƒâ€šÃ‚Â¢ÃƒÆ’Ã‚Â¢ÃƒÂ¢Ã¢â‚¬Å¡Ã‚Â¬Ãƒâ€¦Ã‚Â¡ÃƒÆ’Ã¢â‚¬Å¡Ãƒâ€šÃ‚Â¬ÃƒÆ’Ã†â€™ÃƒÂ¢Ã¢â€šÂ¬Ã…Â¡ÃƒÆ’Ã¢â‚¬Å¡Ãƒâ€šÃ‚Â¦ÃƒÆ’Ã†â€™Ãƒâ€ Ã¢â‚¬â„¢ÃƒÆ’Ã¢â‚¬Â ÃƒÂ¢Ã¢â€šÂ¬Ã¢â€žÂ¢ÃƒÆ’Ã†â€™ÃƒÂ¢Ã¢â€šÂ¬Ã…Â¡ÃƒÆ’Ã¢â‚¬Å¡Ãƒâ€šÃ‚Â¢ÃƒÆ’Ã†â€™Ãƒâ€ Ã¢â‚¬â„¢ÃƒÆ’Ã¢â‚¬Å¡Ãƒâ€šÃ‚Â¢ÃƒÆ’Ã†â€™Ãƒâ€šÃ‚Â¢ÃƒÆ’Ã‚Â¢ÃƒÂ¢Ã¢â€šÂ¬Ã…Â¡Ãƒâ€šÃ‚Â¬ÃƒÆ’Ã¢â‚¬Â¦Ãƒâ€šÃ‚Â¡ÃƒÆ’Ã†â€™ÃƒÂ¢Ã¢â€šÂ¬Ã…Â¡ÃƒÆ’Ã¢â‚¬Å¡Ãƒâ€šÃ‚Â¬ÃƒÆ’Ã†â€™Ãƒâ€ Ã¢â‚¬â„¢ÃƒÆ’Ã‚Â¢ÃƒÂ¢Ã¢â‚¬Å¡Ã‚Â¬Ãƒâ€šÃ‚Â¦ÃƒÆ’Ã†â€™Ãƒâ€šÃ‚Â¢ÃƒÆ’Ã‚Â¢ÃƒÂ¢Ã¢â€šÂ¬Ã…Â¡Ãƒâ€šÃ‚Â¬ÃƒÆ’Ã¢â‚¬Â¦ÃƒÂ¢Ã¢â€šÂ¬Ã…â€œ74 </w:t>
       </w:r>
       <w:proofErr w:type="spellStart"/>
       <w:r>
@@ -8415,7 +8415,7 @@
           <w:sz w:val="28"/>
           <w:szCs w:val="28"/>
         </w:rPr>
-        <w:t>ÃƒÆ’Ã†â€™Ãƒâ€ Ã¢â‚¬â„¢ÃƒÆ’Ã¢â‚¬Â ÃƒÂ¢Ã¢â€šÂ¬Ã¢â€žÂ¢ÃƒÆ’Ã†â€™ÃƒÂ¢Ã¢â€šÂ¬Ã‚Â ÃƒÆ’Ã‚Â¢ÃƒÂ¢Ã¢â‚¬Å¡Ã‚Â¬ÃƒÂ¢Ã¢â‚¬Å¾Ã‚Â¢ÃƒÆ’Ã†â€™Ãƒâ€ Ã¢â‚¬â„¢ÃƒÆ’Ã‚Â¢ÃƒÂ¢Ã¢â‚¬Å¡Ã‚Â¬Ãƒâ€šÃ‚Â¦ÃƒÆ’Ã†â€™ÃƒÂ¢Ã¢â€šÂ¬Ã…Â¡ÃƒÆ’Ã¢â‚¬Å¡Ãƒâ€šÃ‚Â½ÃƒÆ’Ã†â€™Ãƒâ€ Ã¢â‚¬â„¢ÃƒÆ’Ã¢â‚¬Â ÃƒÂ¢Ã¢â€šÂ¬Ã¢â€žÂ¢ÃƒÆ’Ã†â€™Ãƒâ€šÃ‚Â¢ÃƒÆ’Ã‚Â¢ÃƒÂ¢Ã¢â€šÂ¬Ã…Â¡Ãƒâ€šÃ‚Â¬ÃƒÆ’Ã¢â‚¬Â¦Ãƒâ€šÃ‚Â¡ÃƒÆ’Ã†â€™Ãƒâ€ Ã¢â‚¬â„¢ÃƒÆ’Ã‚Â¢ÃƒÂ¢Ã¢â‚¬Å¡Ã‚Â¬Ãƒâ€¦Ã‚Â¡ÃƒÆ’Ã†â€™ÃƒÂ¢Ã¢â€šÂ¬Ã…Â¡ÃƒÆ’Ã¢â‚¬Å¡Ãƒâ€šÃ‚Â¼g</w:t>
+        <w:t>ÃƒÆ’Ã†â€™Ãƒâ€ Ã¢â‚¬â„¢ÃƒÆ’Ã¢â‚¬Â ÃƒÂ¢Ã¢â€šÂ¬Ã¢â€žÂ¢ÃƒÆ’Ã†â€™ÃƒÂ¢Ã¢â€šÂ¬Ã‚Â ÃƒÆ’Ã‚Â¢ÃƒÂ¢Ã¢â‚¬Å¡Ã‚Â¬ÃƒÂ¢Ã¢â‚¬Å¾Ã‚Â¢ÃƒÆ’Ã†â€™Ãƒâ€ Ã¢â‚¬â„¢ÃƒÆ’Ã‚Â¢ÃƒÂ¢Ã¢â‚¬Å¡Ã‚Â¬Ãƒâ€šÃ‚Â ÃƒÆ’Ã†â€™Ãƒâ€šÃ‚Â¢ÃƒÆ’Ã‚Â¢ÃƒÂ¢Ã¢â€šÂ¬Ã…Â¡Ãƒâ€šÃ‚Â¬ÃƒÆ’Ã‚Â¢ÃƒÂ¢Ã¢â€šÂ¬Ã…Â¾Ãƒâ€šÃ‚Â¢ÃƒÆ’Ã†â€™Ãƒâ€ Ã¢â‚¬â„¢ÃƒÆ’Ã¢â‚¬Â ÃƒÂ¢Ã¢â€šÂ¬Ã¢â€žÂ¢ÃƒÆ’Ã†â€™Ãƒâ€šÃ‚Â¢ÃƒÆ’Ã‚Â¢ÃƒÂ¢Ã¢â€šÂ¬Ã…Â¡Ãƒâ€šÃ‚Â¬ÃƒÆ’Ã¢â‚¬Å¡Ãƒâ€šÃ‚Â ÃƒÆ’Ã†â€™Ãƒâ€ Ã¢â‚¬â„¢ÃƒÆ’Ã¢â‚¬Å¡Ãƒâ€šÃ‚Â¢ÃƒÆ’Ã†â€™Ãƒâ€šÃ‚Â¢ÃƒÆ’Ã‚Â¢ÃƒÂ¢Ã¢â‚¬Å¡Ã‚Â¬Ãƒâ€¦Ã‚Â¡ÃƒÆ’Ã¢â‚¬Å¡Ãƒâ€šÃ‚Â¬ÃƒÆ’Ã†â€™Ãƒâ€šÃ‚Â¢ÃƒÆ’Ã‚Â¢ÃƒÂ¢Ã¢â‚¬Å¡Ã‚Â¬Ãƒâ€¦Ã‚Â¾ÃƒÆ’Ã¢â‚¬Å¡Ãƒâ€šÃ‚Â¢ÃƒÆ’Ã†â€™Ãƒâ€ Ã¢â‚¬â„¢ÃƒÆ’Ã¢â‚¬Â ÃƒÂ¢Ã¢â€šÂ¬Ã¢â€žÂ¢ÃƒÆ’Ã†â€™ÃƒÂ¢Ã¢â€šÂ¬Ã‚Â ÃƒÆ’Ã‚Â¢ÃƒÂ¢Ã¢â‚¬Å¡Ã‚Â¬ÃƒÂ¢Ã¢â‚¬Å¾Ã‚Â¢ÃƒÆ’Ã†â€™Ãƒâ€ Ã¢â‚¬â„¢ÃƒÆ’Ã¢â‚¬Å¡Ãƒâ€šÃ‚Â¢ÃƒÆ’Ã†â€™Ãƒâ€šÃ‚Â¢ÃƒÆ’Ã‚Â¢ÃƒÂ¢Ã¢â‚¬Å¡Ã‚Â¬Ãƒâ€¦Ã‚Â¡ÃƒÆ’Ã¢â‚¬Å¡Ãƒâ€šÃ‚Â¬ÃƒÆ’Ã†â€™ÃƒÂ¢Ã¢â€šÂ¬Ã…Â¡ÃƒÆ’Ã¢â‚¬Å¡Ãƒâ€šÃ‚Â¦ÃƒÆ’Ã†â€™Ãƒâ€ Ã¢â‚¬â„¢ÃƒÆ’Ã¢â‚¬Â ÃƒÂ¢Ã¢â€šÂ¬Ã¢â€žÂ¢ÃƒÆ’Ã†â€™Ãƒâ€šÃ‚Â¢ÃƒÆ’Ã‚Â¢ÃƒÂ¢Ã¢â€šÂ¬Ã…Â¡Ãƒâ€šÃ‚Â¬ÃƒÆ’Ã¢â‚¬Â¦Ãƒâ€šÃ‚Â¡ÃƒÆ’Ã†â€™Ãƒâ€ Ã¢â‚¬â„¢ÃƒÆ’Ã‚Â¢ÃƒÂ¢Ã¢â‚¬Å¡Ã‚Â¬Ãƒâ€¦Ã‚Â¡ÃƒÆ’Ã†â€™ÃƒÂ¢Ã¢â€šÂ¬Ã…Â¡ÃƒÆ’Ã¢â‚¬Å¡Ãƒâ€šÃ‚Â½ÃƒÆ’Ã†â€™Ãƒâ€ Ã¢â‚¬â„¢ÃƒÆ’Ã¢â‚¬Â ÃƒÂ¢Ã¢â€šÂ¬Ã¢â€žÂ¢ÃƒÆ’Ã†â€™ÃƒÂ¢Ã¢â€šÂ¬Ã‚Â ÃƒÆ’Ã‚Â¢ÃƒÂ¢Ã¢â‚¬Å¡Ã‚Â¬ÃƒÂ¢Ã¢â‚¬Å¾Ã‚Â¢ÃƒÆ’Ã†â€™Ãƒâ€ Ã¢â‚¬â„¢ÃƒÆ’Ã‚Â¢ÃƒÂ¢Ã¢â‚¬Å¡Ã‚Â¬Ãƒâ€šÃ‚Â ÃƒÆ’Ã†â€™Ãƒâ€šÃ‚Â¢ÃƒÆ’Ã‚Â¢ÃƒÂ¢Ã¢â€šÂ¬Ã…Â¡Ãƒâ€šÃ‚Â¬ÃƒÆ’Ã‚Â¢ÃƒÂ¢Ã¢â€šÂ¬Ã…Â¾Ãƒâ€šÃ‚Â¢ÃƒÆ’Ã†â€™Ãƒâ€ Ã¢â‚¬â„¢ÃƒÆ’Ã¢â‚¬Â ÃƒÂ¢Ã¢â€šÂ¬Ã¢â€žÂ¢ÃƒÆ’Ã†â€™ÃƒÂ¢Ã¢â€šÂ¬Ã…Â¡ÃƒÆ’Ã¢â‚¬Å¡Ãƒâ€šÃ‚Â¢ÃƒÆ’Ã†â€™Ãƒâ€ Ã¢â‚¬â„¢ÃƒÆ’Ã¢â‚¬Å¡Ãƒâ€šÃ‚Â¢ÃƒÆ’Ã†â€™Ãƒâ€šÃ‚Â¢ÃƒÆ’Ã‚Â¢ÃƒÂ¢Ã¢â€šÂ¬Ã…Â¡Ãƒâ€šÃ‚Â¬ÃƒÆ’Ã¢â‚¬Â¦Ãƒâ€šÃ‚Â¡ÃƒÆ’Ã†â€™ÃƒÂ¢Ã¢â€šÂ¬Ã…Â¡ÃƒÆ’Ã¢â‚¬Å¡Ãƒâ€šÃ‚Â¬ÃƒÆ’Ã†â€™Ãƒâ€ Ã¢â‚¬â„¢ÃƒÆ’Ã‚Â¢ÃƒÂ¢Ã¢â‚¬Å¡Ã‚Â¬Ãƒâ€šÃ‚Â¦ÃƒÆ’Ã†â€™ÃƒÂ¢Ã¢â€šÂ¬Ã…Â¡ÃƒÆ’Ã¢â‚¬Å¡Ãƒâ€šÃ‚Â¡ÃƒÆ’Ã†â€™Ãƒâ€ Ã¢â‚¬â„¢ÃƒÆ’Ã¢â‚¬Â ÃƒÂ¢Ã¢â€šÂ¬Ã¢â€žÂ¢ÃƒÆ’Ã†â€™ÃƒÂ¢Ã¢â€šÂ¬Ã‚Â ÃƒÆ’Ã‚Â¢ÃƒÂ¢Ã¢â‚¬Å¡Ã‚Â¬ÃƒÂ¢Ã¢â‚¬Å¾Ã‚Â¢ÃƒÆ’Ã†â€™Ãƒâ€ Ã¢â‚¬â„¢ÃƒÆ’Ã¢â‚¬Å¡Ãƒâ€šÃ‚Â¢ÃƒÆ’Ã†â€™Ãƒâ€šÃ‚Â¢ÃƒÆ’Ã‚Â¢ÃƒÂ¢Ã¢â‚¬Å¡Ã‚Â¬Ãƒâ€¦Ã‚Â¡ÃƒÆ’Ã¢â‚¬Å¡Ãƒâ€šÃ‚Â¬ÃƒÆ’Ã†â€™ÃƒÂ¢Ã¢â€šÂ¬Ã‚Â¦ÃƒÆ’Ã¢â‚¬Å¡Ãƒâ€šÃ‚Â¡ÃƒÆ’Ã†â€™Ãƒâ€ Ã¢â‚¬â„¢ÃƒÆ’Ã¢â‚¬Â ÃƒÂ¢Ã¢â€šÂ¬Ã¢â€žÂ¢ÃƒÆ’Ã†â€™Ãƒâ€šÃ‚Â¢ÃƒÆ’Ã‚Â¢ÃƒÂ¢Ã¢â€šÂ¬Ã…Â¡Ãƒâ€šÃ‚Â¬ÃƒÆ’Ã¢â‚¬Â¦Ãƒâ€šÃ‚Â¡ÃƒÆ’Ã†â€™Ãƒâ€ Ã¢â‚¬â„¢ÃƒÆ’Ã‚Â¢ÃƒÂ¢Ã¢â‚¬Å¡Ã‚Â¬Ãƒâ€¦Ã‚Â¡ÃƒÆ’Ã†â€™ÃƒÂ¢Ã¢â€šÂ¬Ã…Â¡ÃƒÆ’Ã¢â‚¬Å¡Ãƒâ€šÃ‚Â¼g</w:t>
       </w:r>
       <w:proofErr w:type="spellEnd"/>
       <w:r>
@@ -8551,7 +8551,7 @@
           <w:szCs w:val="28"/>
         </w:rPr>
         <w:lastRenderedPageBreak/>
-        <w:t>The bar chart illustrates the changes in nitrite nitrogen (NOÃƒÆ’Ã†â€™Ãƒâ€ Ã¢â‚¬â„¢ÃƒÆ’Ã¢â‚¬Â ÃƒÂ¢Ã¢â€šÂ¬Ã¢â€žÂ¢ÃƒÆ’Ã†â€™ÃƒÂ¢Ã¢â€šÂ¬Ã‚Â ÃƒÆ’Ã‚Â¢ÃƒÂ¢Ã¢â‚¬Å¡Ã‚Â¬ÃƒÂ¢Ã¢â‚¬Å¾Ã‚Â¢ÃƒÆ’Ã†â€™Ãƒâ€ Ã¢â‚¬â„¢ÃƒÆ’Ã‚Â¢ÃƒÂ¢Ã¢â‚¬Å¡Ã‚Â¬Ãƒâ€¦Ã‚Â¡ÃƒÆ’Ã†â€™ÃƒÂ¢Ã¢â€šÂ¬Ã…Â¡ÃƒÆ’Ã¢â‚¬Å¡Ãƒâ€šÃ‚Â¢ÃƒÆ’Ã†â€™Ãƒâ€ Ã¢â‚¬â„¢ÃƒÆ’Ã¢â‚¬Â ÃƒÂ¢Ã¢â€šÂ¬Ã¢â€žÂ¢ÃƒÆ’Ã†â€™ÃƒÂ¢Ã¢â€šÂ¬Ã…Â¡ÃƒÆ’Ã¢â‚¬Å¡Ãƒâ€šÃ‚Â¢ÃƒÆ’Ã†â€™Ãƒâ€ Ã¢â‚¬â„¢ÃƒÆ’Ã¢â‚¬Å¡Ãƒâ€šÃ‚Â¢ÃƒÆ’Ã†â€™Ãƒâ€šÃ‚Â¢ÃƒÆ’Ã‚Â¢ÃƒÂ¢Ã¢â€šÂ¬Ã…Â¡Ãƒâ€šÃ‚Â¬ÃƒÆ’Ã¢â‚¬Â¦Ãƒâ€šÃ‚Â¡ÃƒÆ’Ã†â€™ÃƒÂ¢Ã¢â€šÂ¬Ã…Â¡ÃƒÆ’Ã¢â‚¬Å¡Ãƒâ€šÃ‚Â¬ÃƒÆ’Ã†â€™Ãƒâ€ Ã¢â‚¬â„¢ÃƒÆ’Ã‚Â¢ÃƒÂ¢Ã¢â‚¬Å¡Ã‚Â¬Ãƒâ€šÃ‚Â¦ÃƒÆ’Ã†â€™ÃƒÂ¢Ã¢â€šÂ¬Ã…Â¡ÃƒÆ’Ã¢â‚¬Å¡Ãƒâ€šÃ‚Â¡ÃƒÆ’Ã†â€™Ãƒâ€ Ã¢â‚¬â„¢ÃƒÆ’Ã¢â‚¬Â ÃƒÂ¢Ã¢â€šÂ¬Ã¢â€žÂ¢ÃƒÆ’Ã†â€™ÃƒÂ¢Ã¢â€šÂ¬Ã…Â¡ÃƒÆ’Ã¢â‚¬Å¡Ãƒâ€šÃ‚Â¢ÃƒÆ’Ã†â€™Ãƒâ€ Ã¢â‚¬â„¢ÃƒÆ’Ã¢â‚¬Å¡Ãƒâ€šÃ‚Â¢ÃƒÆ’Ã†â€™Ãƒâ€šÃ‚Â¢ÃƒÆ’Ã‚Â¢ÃƒÂ¢Ã¢â€šÂ¬Ã…Â¡Ãƒâ€šÃ‚Â¬ÃƒÆ’Ã¢â‚¬Â¦Ãƒâ€šÃ‚Â¡ÃƒÆ’Ã†â€™ÃƒÂ¢Ã¢â€šÂ¬Ã…Â¡ÃƒÆ’Ã¢â‚¬Å¡Ãƒâ€šÃ‚Â¬ÃƒÆ’Ã†â€™Ãƒâ€ Ã¢â‚¬â„¢ÃƒÆ’Ã‚Â¢ÃƒÂ¢Ã¢â‚¬Å¡Ã‚Â¬Ãƒâ€šÃ‚Â¦ÃƒÆ’Ã†â€™ÃƒÂ¢Ã¢â€šÂ¬Ã…Â¡ÃƒÆ’Ã¢â‚¬Å¡Ãƒâ€šÃ‚Â¡ÃƒÆ’Ã†â€™Ãƒâ€ Ã¢â‚¬â„¢ÃƒÆ’Ã¢â‚¬Â ÃƒÂ¢Ã¢â€šÂ¬Ã¢â€žÂ¢ÃƒÆ’Ã†â€™ÃƒÂ¢Ã¢â€šÂ¬Ã‚Â ÃƒÆ’Ã‚Â¢ÃƒÂ¢Ã¢â‚¬Å¡Ã‚Â¬ÃƒÂ¢Ã¢â‚¬Å¾Ã‚Â¢ÃƒÆ’Ã†â€™Ãƒâ€ Ã¢â‚¬â„¢ÃƒÆ’Ã‚Â¢ÃƒÂ¢Ã¢â‚¬Å¡Ã‚Â¬Ãƒâ€¦Ã‚Â¡ÃƒÆ’Ã†â€™ÃƒÂ¢Ã¢â€šÂ¬Ã…Â¡ÃƒÆ’Ã¢â‚¬Å¡Ãƒâ€šÃ‚Â¢ÃƒÆ’Ã†â€™Ãƒâ€ Ã¢â‚¬â„¢ÃƒÆ’Ã¢â‚¬Â ÃƒÂ¢Ã¢â€šÂ¬Ã¢â€žÂ¢ÃƒÆ’Ã†â€™Ãƒâ€šÃ‚Â¢ÃƒÆ’Ã‚Â¢ÃƒÂ¢Ã¢â€šÂ¬Ã…Â¡Ãƒâ€šÃ‚Â¬ÃƒÆ’Ã¢â‚¬Â¦Ãƒâ€šÃ‚Â¡ÃƒÆ’Ã†â€™Ãƒâ€ Ã¢â‚¬â„¢ÃƒÆ’Ã‚Â¢ÃƒÂ¢Ã¢â‚¬Å¡Ã‚Â¬Ãƒâ€¦Ã‚Â¡ÃƒÆ’Ã†â€™ÃƒÂ¢Ã¢â€šÂ¬Ã…Â¡ÃƒÆ’Ã¢â‚¬Å¡Ãƒâ€šÃ‚ÂÃƒÆ’Ã†â€™Ãƒâ€ Ã¢â‚¬â„¢ÃƒÆ’Ã¢â‚¬Â ÃƒÂ¢Ã¢â€šÂ¬Ã¢â€žÂ¢ÃƒÆ’Ã†â€™Ãƒâ€šÃ‚Â¢ÃƒÆ’Ã‚Â¢ÃƒÂ¢Ã¢â€šÂ¬Ã…Â¡Ãƒâ€šÃ‚Â¬ÃƒÆ’Ã¢â‚¬Â¦Ãƒâ€šÃ‚Â¡ÃƒÆ’Ã†â€™Ãƒâ€ Ã¢â‚¬â„¢ÃƒÆ’Ã‚Â¢ÃƒÂ¢Ã¢â‚¬Å¡Ã‚Â¬Ãƒâ€¦Ã‚Â¡ÃƒÆ’Ã†â€™ÃƒÂ¢Ã¢â€šÂ¬Ã…Â¡ÃƒÆ’Ã¢â‚¬Å¡Ãƒâ€šÃ‚Â»-N) concentration (</w:t>
+        <w:t>The bar chart illustrates the changes in nitrite nitrogen (NOÃƒÆ’Ã†â€™Ãƒâ€ Ã¢â‚¬â„¢ÃƒÆ’Ã¢â‚¬Â ÃƒÂ¢Ã¢â€šÂ¬Ã¢â€žÂ¢ÃƒÆ’Ã†â€™ÃƒÂ¢Ã¢â€šÂ¬Ã‚Â ÃƒÆ’Ã‚Â¢ÃƒÂ¢Ã¢â‚¬Å¡Ã‚Â¬ÃƒÂ¢Ã¢â‚¬Å¾Ã‚Â¢ÃƒÆ’Ã†â€™Ãƒâ€ Ã¢â‚¬â„¢ÃƒÆ’Ã‚Â¢ÃƒÂ¢Ã¢â‚¬Å¡Ã‚Â¬Ãƒâ€šÃ‚Â ÃƒÆ’Ã†â€™Ãƒâ€šÃ‚Â¢ÃƒÆ’Ã‚Â¢ÃƒÂ¢Ã¢â€šÂ¬Ã…Â¡Ãƒâ€šÃ‚Â¬ÃƒÆ’Ã‚Â¢ÃƒÂ¢Ã¢â€šÂ¬Ã…Â¾Ãƒâ€šÃ‚Â¢ÃƒÆ’Ã†â€™Ãƒâ€ Ã¢â‚¬â„¢ÃƒÆ’Ã¢â‚¬Â ÃƒÂ¢Ã¢â€šÂ¬Ã¢â€žÂ¢ÃƒÆ’Ã†â€™Ãƒâ€šÃ‚Â¢ÃƒÆ’Ã‚Â¢ÃƒÂ¢Ã¢â€šÂ¬Ã…Â¡Ãƒâ€šÃ‚Â¬ÃƒÆ’Ã¢â‚¬Å¡Ãƒâ€šÃ‚Â ÃƒÆ’Ã†â€™Ãƒâ€ Ã¢â‚¬â„¢ÃƒÆ’Ã¢â‚¬Å¡Ãƒâ€šÃ‚Â¢ÃƒÆ’Ã†â€™Ãƒâ€šÃ‚Â¢ÃƒÆ’Ã‚Â¢ÃƒÂ¢Ã¢â‚¬Å¡Ã‚Â¬Ãƒâ€¦Ã‚Â¡ÃƒÆ’Ã¢â‚¬Å¡Ãƒâ€šÃ‚Â¬ÃƒÆ’Ã†â€™Ãƒâ€šÃ‚Â¢ÃƒÆ’Ã‚Â¢ÃƒÂ¢Ã¢â‚¬Å¡Ã‚Â¬Ãƒâ€¦Ã‚Â¾ÃƒÆ’Ã¢â‚¬Å¡Ãƒâ€šÃ‚Â¢ÃƒÆ’Ã†â€™Ãƒâ€ Ã¢â‚¬â„¢ÃƒÆ’Ã¢â‚¬Â ÃƒÂ¢Ã¢â€šÂ¬Ã¢â€žÂ¢ÃƒÆ’Ã†â€™ÃƒÂ¢Ã¢â€šÂ¬Ã‚Â ÃƒÆ’Ã‚Â¢ÃƒÂ¢Ã¢â‚¬Å¡Ã‚Â¬ÃƒÂ¢Ã¢â‚¬Å¾Ã‚Â¢ÃƒÆ’Ã†â€™Ãƒâ€ Ã¢â‚¬â„¢ÃƒÆ’Ã¢â‚¬Å¡Ãƒâ€šÃ‚Â¢ÃƒÆ’Ã†â€™Ãƒâ€šÃ‚Â¢ÃƒÆ’Ã‚Â¢ÃƒÂ¢Ã¢â‚¬Å¡Ã‚Â¬Ãƒâ€¦Ã‚Â¡ÃƒÆ’Ã¢â‚¬Å¡Ãƒâ€šÃ‚Â¬ÃƒÆ’Ã†â€™ÃƒÂ¢Ã¢â€šÂ¬Ã‚Â¦ÃƒÆ’Ã¢â‚¬Å¡Ãƒâ€šÃ‚Â¡ÃƒÆ’Ã†â€™Ãƒâ€ Ã¢â‚¬â„¢ÃƒÆ’Ã¢â‚¬Â ÃƒÂ¢Ã¢â€šÂ¬Ã¢â€žÂ¢ÃƒÆ’Ã†â€™Ãƒâ€šÃ‚Â¢ÃƒÆ’Ã‚Â¢ÃƒÂ¢Ã¢â€šÂ¬Ã…Â¡Ãƒâ€šÃ‚Â¬ÃƒÆ’Ã¢â‚¬Â¦Ãƒâ€šÃ‚Â¡ÃƒÆ’Ã†â€™Ãƒâ€ Ã¢â‚¬â„¢ÃƒÆ’Ã‚Â¢ÃƒÂ¢Ã¢â‚¬Å¡Ã‚Â¬Ãƒâ€¦Ã‚Â¡ÃƒÆ’Ã†â€™ÃƒÂ¢Ã¢â€šÂ¬Ã…Â¡ÃƒÆ’Ã¢â‚¬Å¡Ãƒâ€šÃ‚Â¢ÃƒÆ’Ã†â€™Ãƒâ€ Ã¢â‚¬â„¢ÃƒÆ’Ã¢â‚¬Â ÃƒÂ¢Ã¢â€šÂ¬Ã¢â€žÂ¢ÃƒÆ’Ã†â€™ÃƒÂ¢Ã¢â€šÂ¬Ã‚Â ÃƒÆ’Ã‚Â¢ÃƒÂ¢Ã¢â‚¬Å¡Ã‚Â¬ÃƒÂ¢Ã¢â‚¬Å¾Ã‚Â¢ÃƒÆ’Ã†â€™Ãƒâ€ Ã¢â‚¬â„¢ÃƒÆ’Ã‚Â¢ÃƒÂ¢Ã¢â‚¬Å¡Ã‚Â¬Ãƒâ€šÃ‚Â ÃƒÆ’Ã†â€™Ãƒâ€šÃ‚Â¢ÃƒÆ’Ã‚Â¢ÃƒÂ¢Ã¢â€šÂ¬Ã…Â¡Ãƒâ€šÃ‚Â¬ÃƒÆ’Ã‚Â¢ÃƒÂ¢Ã¢â€šÂ¬Ã…Â¾Ãƒâ€šÃ‚Â¢ÃƒÆ’Ã†â€™Ãƒâ€ Ã¢â‚¬â„¢ÃƒÆ’Ã¢â‚¬Â ÃƒÂ¢Ã¢â€šÂ¬Ã¢â€žÂ¢ÃƒÆ’Ã†â€™Ãƒâ€šÃ‚Â¢ÃƒÆ’Ã‚Â¢ÃƒÂ¢Ã¢â€šÂ¬Ã…Â¡Ãƒâ€šÃ‚Â¬ÃƒÆ’Ã¢â‚¬Â¦Ãƒâ€šÃ‚Â¡ÃƒÆ’Ã†â€™Ãƒâ€ Ã¢â‚¬â„¢ÃƒÆ’Ã‚Â¢ÃƒÂ¢Ã¢â‚¬Å¡Ã‚Â¬Ãƒâ€¦Ã‚Â¡ÃƒÆ’Ã†â€™ÃƒÂ¢Ã¢â€šÂ¬Ã…Â¡ÃƒÆ’Ã¢â‚¬Å¡Ãƒâ€šÃ‚Â¢ÃƒÆ’Ã†â€™Ãƒâ€ Ã¢â‚¬â„¢ÃƒÆ’Ã¢â‚¬Â ÃƒÂ¢Ã¢â€šÂ¬Ã¢â€žÂ¢ÃƒÆ’Ã†â€™ÃƒÂ¢Ã¢â€šÂ¬Ã‚Â ÃƒÆ’Ã‚Â¢ÃƒÂ¢Ã¢â‚¬Å¡Ã‚Â¬ÃƒÂ¢Ã¢â‚¬Å¾Ã‚Â¢ÃƒÆ’Ã†â€™Ãƒâ€ Ã¢â‚¬â„¢ÃƒÆ’Ã‚Â¢ÃƒÂ¢Ã¢â‚¬Å¡Ã‚Â¬Ãƒâ€¦Ã‚Â¡ÃƒÆ’Ã†â€™ÃƒÂ¢Ã¢â€šÂ¬Ã…Â¡ÃƒÆ’Ã¢â‚¬Å¡Ãƒâ€šÃ‚Â¢ÃƒÆ’Ã†â€™Ãƒâ€ Ã¢â‚¬â„¢ÃƒÆ’Ã¢â‚¬Â ÃƒÂ¢Ã¢â€šÂ¬Ã¢â€žÂ¢ÃƒÆ’Ã†â€™ÃƒÂ¢Ã¢â€šÂ¬Ã…Â¡ÃƒÆ’Ã¢â‚¬Å¡Ãƒâ€šÃ‚Â¢ÃƒÆ’Ã†â€™Ãƒâ€ Ã¢â‚¬â„¢ÃƒÆ’Ã¢â‚¬Å¡Ãƒâ€šÃ‚Â¢ÃƒÆ’Ã†â€™Ãƒâ€šÃ‚Â¢ÃƒÆ’Ã‚Â¢ÃƒÂ¢Ã¢â€šÂ¬Ã…Â¡Ãƒâ€šÃ‚Â¬ÃƒÆ’Ã¢â‚¬Â¦Ãƒâ€šÃ‚Â¡ÃƒÆ’Ã†â€™ÃƒÂ¢Ã¢â€šÂ¬Ã…Â¡ÃƒÆ’Ã¢â‚¬Å¡Ãƒâ€šÃ‚Â¬ÃƒÆ’Ã†â€™Ãƒâ€ Ã¢â‚¬â„¢ÃƒÆ’Ã‚Â¢ÃƒÂ¢Ã¢â‚¬Å¡Ã‚Â¬Ãƒâ€šÃ‚Â¦ÃƒÆ’Ã†â€™ÃƒÂ¢Ã¢â€šÂ¬Ã…Â¡ÃƒÆ’Ã¢â‚¬Å¡Ãƒâ€šÃ‚Â¡ÃƒÆ’Ã†â€™Ãƒâ€ Ã¢â‚¬â„¢ÃƒÆ’Ã¢â‚¬Â ÃƒÂ¢Ã¢â€šÂ¬Ã¢â€žÂ¢ÃƒÆ’Ã†â€™Ãƒâ€šÃ‚Â¢ÃƒÆ’Ã‚Â¢ÃƒÂ¢Ã¢â€šÂ¬Ã…Â¡Ãƒâ€šÃ‚Â¬ÃƒÆ’Ã¢â‚¬Â¦Ãƒâ€šÃ‚Â¡ÃƒÆ’Ã†â€™Ãƒâ€ Ã¢â‚¬â„¢ÃƒÆ’Ã‚Â¢ÃƒÂ¢Ã¢â‚¬Å¡Ã‚Â¬Ãƒâ€¦Ã‚Â¡ÃƒÆ’Ã†â€™ÃƒÂ¢Ã¢â€šÂ¬Ã…Â¡ÃƒÆ’Ã¢â‚¬Å¡Ãƒâ€šÃ‚Â¬ÃƒÆ’Ã†â€™Ãƒâ€ Ã¢â‚¬â„¢ÃƒÆ’Ã¢â‚¬Â ÃƒÂ¢Ã¢â€šÂ¬Ã¢â€žÂ¢ÃƒÆ’Ã†â€™ÃƒÂ¢Ã¢â€šÂ¬Ã‚Â ÃƒÆ’Ã‚Â¢ÃƒÂ¢Ã¢â‚¬Å¡Ã‚Â¬ÃƒÂ¢Ã¢â‚¬Å¾Ã‚Â¢ÃƒÆ’Ã†â€™Ãƒâ€ Ã¢â‚¬â„¢ÃƒÆ’Ã¢â‚¬Å¡Ãƒâ€šÃ‚Â¢ÃƒÆ’Ã†â€™Ãƒâ€šÃ‚Â¢ÃƒÆ’Ã‚Â¢ÃƒÂ¢Ã¢â‚¬Å¡Ã‚Â¬Ãƒâ€¦Ã‚Â¡ÃƒÆ’Ã¢â‚¬Å¡Ãƒâ€šÃ‚Â¬ÃƒÆ’Ã†â€™ÃƒÂ¢Ã¢â€šÂ¬Ã…Â¡ÃƒÆ’Ã¢â‚¬Å¡Ãƒâ€šÃ‚Â¦ÃƒÆ’Ã†â€™Ãƒâ€ Ã¢â‚¬â„¢ÃƒÆ’Ã¢â‚¬Â ÃƒÂ¢Ã¢â€šÂ¬Ã¢â€žÂ¢ÃƒÆ’Ã†â€™Ãƒâ€šÃ‚Â¢ÃƒÆ’Ã‚Â¢ÃƒÂ¢Ã¢â€šÂ¬Ã…Â¡Ãƒâ€šÃ‚Â¬ÃƒÆ’Ã¢â‚¬Â¦Ãƒâ€šÃ‚Â¡ÃƒÆ’Ã†â€™Ãƒâ€ Ã¢â‚¬â„¢ÃƒÆ’Ã‚Â¢ÃƒÂ¢Ã¢â‚¬Å¡Ã‚Â¬Ãƒâ€¦Ã‚Â¡ÃƒÆ’Ã†â€™ÃƒÂ¢Ã¢â€šÂ¬Ã…Â¡ÃƒÆ’Ã¢â‚¬Å¡Ãƒâ€šÃ‚Â¡ÃƒÆ’Ã†â€™Ãƒâ€ Ã¢â‚¬â„¢ÃƒÆ’Ã¢â‚¬Â ÃƒÂ¢Ã¢â€šÂ¬Ã¢â€žÂ¢ÃƒÆ’Ã†â€™ÃƒÂ¢Ã¢â€šÂ¬Ã‚Â ÃƒÆ’Ã‚Â¢ÃƒÂ¢Ã¢â‚¬Å¡Ã‚Â¬ÃƒÂ¢Ã¢â‚¬Å¾Ã‚Â¢ÃƒÆ’Ã†â€™Ãƒâ€ Ã¢â‚¬â„¢ÃƒÆ’Ã‚Â¢ÃƒÂ¢Ã¢â‚¬Å¡Ã‚Â¬Ãƒâ€šÃ‚Â ÃƒÆ’Ã†â€™Ãƒâ€šÃ‚Â¢ÃƒÆ’Ã‚Â¢ÃƒÂ¢Ã¢â€šÂ¬Ã…Â¡Ãƒâ€šÃ‚Â¬ÃƒÆ’Ã‚Â¢ÃƒÂ¢Ã¢â€šÂ¬Ã…Â¾Ãƒâ€šÃ‚Â¢ÃƒÆ’Ã†â€™Ãƒâ€ Ã¢â‚¬â„¢ÃƒÆ’Ã¢â‚¬Â ÃƒÂ¢Ã¢â€šÂ¬Ã¢â€žÂ¢ÃƒÆ’Ã†â€™Ãƒâ€šÃ‚Â¢ÃƒÆ’Ã‚Â¢ÃƒÂ¢Ã¢â€šÂ¬Ã…Â¡Ãƒâ€šÃ‚Â¬ÃƒÆ’Ã¢â‚¬Â¦Ãƒâ€šÃ‚Â¡ÃƒÆ’Ã†â€™Ãƒâ€ Ã¢â‚¬â„¢ÃƒÆ’Ã‚Â¢ÃƒÂ¢Ã¢â‚¬Å¡Ã‚Â¬Ãƒâ€¦Ã‚Â¡ÃƒÆ’Ã†â€™ÃƒÂ¢Ã¢â€šÂ¬Ã…Â¡ÃƒÆ’Ã¢â‚¬Å¡Ãƒâ€šÃ‚Â¢ÃƒÆ’Ã†â€™Ãƒâ€ Ã¢â‚¬â„¢ÃƒÆ’Ã¢â‚¬Â ÃƒÂ¢Ã¢â€šÂ¬Ã¢â€žÂ¢ÃƒÆ’Ã†â€™ÃƒÂ¢Ã¢â€šÂ¬Ã‚Â ÃƒÆ’Ã‚Â¢ÃƒÂ¢Ã¢â‚¬Å¡Ã‚Â¬ÃƒÂ¢Ã¢â‚¬Å¾Ã‚Â¢ÃƒÆ’Ã†â€™Ãƒâ€ Ã¢â‚¬â„¢ÃƒÆ’Ã‚Â¢ÃƒÂ¢Ã¢â‚¬Å¡Ã‚Â¬Ãƒâ€¦Ã‚Â¡ÃƒÆ’Ã†â€™ÃƒÂ¢Ã¢â€šÂ¬Ã…Â¡ÃƒÆ’Ã¢â‚¬Å¡Ãƒâ€šÃ‚Â¢ÃƒÆ’Ã†â€™Ãƒâ€ Ã¢â‚¬â„¢ÃƒÆ’Ã¢â‚¬Â ÃƒÂ¢Ã¢â€šÂ¬Ã¢â€žÂ¢ÃƒÆ’Ã†â€™ÃƒÂ¢Ã¢â€šÂ¬Ã…Â¡ÃƒÆ’Ã¢â‚¬Å¡Ãƒâ€šÃ‚Â¢ÃƒÆ’Ã†â€™Ãƒâ€ Ã¢â‚¬â„¢ÃƒÆ’Ã¢â‚¬Å¡Ãƒâ€šÃ‚Â¢ÃƒÆ’Ã†â€™Ãƒâ€šÃ‚Â¢ÃƒÆ’Ã‚Â¢ÃƒÂ¢Ã¢â€šÂ¬Ã…Â¡Ãƒâ€šÃ‚Â¬ÃƒÆ’Ã¢â‚¬Â¦Ãƒâ€šÃ‚Â¡ÃƒÆ’Ã†â€™ÃƒÂ¢Ã¢â€šÂ¬Ã…Â¡ÃƒÆ’Ã¢â‚¬Å¡Ãƒâ€šÃ‚Â¬ÃƒÆ’Ã†â€™Ãƒâ€ Ã¢â‚¬â„¢ÃƒÆ’Ã‚Â¢ÃƒÂ¢Ã¢â‚¬Å¡Ã‚Â¬Ãƒâ€šÃ‚Â¦ÃƒÆ’Ã†â€™ÃƒÂ¢Ã¢â€šÂ¬Ã…Â¡ÃƒÆ’Ã¢â‚¬Å¡Ãƒâ€šÃ‚Â¡ÃƒÆ’Ã†â€™Ãƒâ€ Ã¢â‚¬â„¢ÃƒÆ’Ã¢â‚¬Â ÃƒÂ¢Ã¢â€šÂ¬Ã¢â€žÂ¢ÃƒÆ’Ã†â€™Ãƒâ€šÃ‚Â¢ÃƒÆ’Ã‚Â¢ÃƒÂ¢Ã¢â€šÂ¬Ã…Â¡Ãƒâ€šÃ‚Â¬ÃƒÆ’Ã¢â‚¬Â¦Ãƒâ€šÃ‚Â¡ÃƒÆ’Ã†â€™Ãƒâ€ Ã¢â‚¬â„¢ÃƒÆ’Ã‚Â¢ÃƒÂ¢Ã¢â‚¬Å¡Ã‚Â¬Ãƒâ€¦Ã‚Â¡ÃƒÆ’Ã†â€™ÃƒÂ¢Ã¢â€šÂ¬Ã…Â¡ÃƒÆ’Ã¢â‚¬Å¡Ãƒâ€šÃ‚Â¬ÃƒÆ’Ã†â€™Ãƒâ€ Ã¢â‚¬â„¢ÃƒÆ’Ã¢â‚¬Â ÃƒÂ¢Ã¢â€šÂ¬Ã¢â€žÂ¢ÃƒÆ’Ã†â€™ÃƒÂ¢Ã¢â€šÂ¬Ã‚Â ÃƒÆ’Ã‚Â¢ÃƒÂ¢Ã¢â‚¬Å¡Ã‚Â¬ÃƒÂ¢Ã¢â‚¬Å¾Ã‚Â¢ÃƒÆ’Ã†â€™Ãƒâ€ Ã¢â‚¬â„¢ÃƒÆ’Ã¢â‚¬Å¡Ãƒâ€šÃ‚Â¢ÃƒÆ’Ã†â€™Ãƒâ€šÃ‚Â¢ÃƒÆ’Ã‚Â¢ÃƒÂ¢Ã¢â‚¬Å¡Ã‚Â¬Ãƒâ€¦Ã‚Â¡ÃƒÆ’Ã¢â‚¬Å¡Ãƒâ€šÃ‚Â¬ÃƒÆ’Ã†â€™ÃƒÂ¢Ã¢â€šÂ¬Ã…Â¡ÃƒÆ’Ã¢â‚¬Å¡Ãƒâ€šÃ‚Â¦ÃƒÆ’Ã†â€™Ãƒâ€ Ã¢â‚¬â„¢ÃƒÆ’Ã¢â‚¬Â ÃƒÂ¢Ã¢â€šÂ¬Ã¢â€žÂ¢ÃƒÆ’Ã†â€™Ãƒâ€šÃ‚Â¢ÃƒÆ’Ã‚Â¢ÃƒÂ¢Ã¢â€šÂ¬Ã…Â¡Ãƒâ€šÃ‚Â¬ÃƒÆ’Ã¢â‚¬Â¦Ãƒâ€šÃ‚Â¡ÃƒÆ’Ã†â€™Ãƒâ€ Ã¢â‚¬â„¢ÃƒÆ’Ã‚Â¢ÃƒÂ¢Ã¢â‚¬Å¡Ã‚Â¬Ãƒâ€¦Ã‚Â¡ÃƒÆ’Ã†â€™ÃƒÂ¢Ã¢â€šÂ¬Ã…Â¡ÃƒÆ’Ã¢â‚¬Å¡Ãƒâ€šÃ‚Â¡ÃƒÆ’Ã†â€™Ãƒâ€ Ã¢â‚¬â„¢ÃƒÆ’Ã¢â‚¬Â ÃƒÂ¢Ã¢â€šÂ¬Ã¢â€žÂ¢ÃƒÆ’Ã†â€™ÃƒÂ¢Ã¢â€šÂ¬Ã‚Â ÃƒÆ’Ã‚Â¢ÃƒÂ¢Ã¢â‚¬Å¡Ã‚Â¬ÃƒÂ¢Ã¢â‚¬Å¾Ã‚Â¢ÃƒÆ’Ã†â€™Ãƒâ€ Ã¢â‚¬â„¢ÃƒÆ’Ã‚Â¢ÃƒÂ¢Ã¢â‚¬Å¡Ã‚Â¬Ãƒâ€šÃ‚Â ÃƒÆ’Ã†â€™Ãƒâ€šÃ‚Â¢ÃƒÆ’Ã‚Â¢ÃƒÂ¢Ã¢â€šÂ¬Ã…Â¡Ãƒâ€šÃ‚Â¬ÃƒÆ’Ã‚Â¢ÃƒÂ¢Ã¢â€šÂ¬Ã…Â¾Ãƒâ€šÃ‚Â¢ÃƒÆ’Ã†â€™Ãƒâ€ Ã¢â‚¬â„¢ÃƒÆ’Ã¢â‚¬Â ÃƒÂ¢Ã¢â€šÂ¬Ã¢â€žÂ¢ÃƒÆ’Ã†â€™Ãƒâ€šÃ‚Â¢ÃƒÆ’Ã‚Â¢ÃƒÂ¢Ã¢â€šÂ¬Ã…Â¡Ãƒâ€šÃ‚Â¬ÃƒÆ’Ã¢â‚¬Å¡Ãƒâ€šÃ‚Â ÃƒÆ’Ã†â€™Ãƒâ€ Ã¢â‚¬â„¢ÃƒÆ’Ã¢â‚¬Å¡Ãƒâ€šÃ‚Â¢ÃƒÆ’Ã†â€™Ãƒâ€šÃ‚Â¢ÃƒÆ’Ã‚Â¢ÃƒÂ¢Ã¢â‚¬Å¡Ã‚Â¬Ãƒâ€¦Ã‚Â¡ÃƒÆ’Ã¢â‚¬Å¡Ãƒâ€šÃ‚Â¬ÃƒÆ’Ã†â€™Ãƒâ€šÃ‚Â¢ÃƒÆ’Ã‚Â¢ÃƒÂ¢Ã¢â‚¬Å¡Ã‚Â¬Ãƒâ€¦Ã‚Â¾ÃƒÆ’Ã¢â‚¬Å¡Ãƒâ€šÃ‚Â¢ÃƒÆ’Ã†â€™Ãƒâ€ Ã¢â‚¬â„¢ÃƒÆ’Ã¢â‚¬Â ÃƒÂ¢Ã¢â€šÂ¬Ã¢â€žÂ¢ÃƒÆ’Ã†â€™ÃƒÂ¢Ã¢â€šÂ¬Ã‚Â ÃƒÆ’Ã‚Â¢ÃƒÂ¢Ã¢â‚¬Å¡Ã‚Â¬ÃƒÂ¢Ã¢â‚¬Å¾Ã‚Â¢ÃƒÆ’Ã†â€™Ãƒâ€ Ã¢â‚¬â„¢ÃƒÆ’Ã¢â‚¬Å¡Ãƒâ€šÃ‚Â¢ÃƒÆ’Ã†â€™Ãƒâ€šÃ‚Â¢ÃƒÆ’Ã‚Â¢ÃƒÂ¢Ã¢â‚¬Å¡Ã‚Â¬Ãƒâ€¦Ã‚Â¡ÃƒÆ’Ã¢â‚¬Å¡Ãƒâ€šÃ‚Â¬ÃƒÆ’Ã†â€™ÃƒÂ¢Ã¢â€šÂ¬Ã‚Â¦ÃƒÆ’Ã¢â‚¬Å¡Ãƒâ€šÃ‚Â¡ÃƒÆ’Ã†â€™Ãƒâ€ Ã¢â‚¬â„¢ÃƒÆ’Ã¢â‚¬Â ÃƒÂ¢Ã¢â€šÂ¬Ã¢â€žÂ¢ÃƒÆ’Ã†â€™Ãƒâ€šÃ‚Â¢ÃƒÆ’Ã‚Â¢ÃƒÂ¢Ã¢â€šÂ¬Ã…Â¡Ãƒâ€šÃ‚Â¬ÃƒÆ’Ã¢â‚¬Â¦Ãƒâ€šÃ‚Â¡ÃƒÆ’Ã†â€™Ãƒâ€ Ã¢â‚¬â„¢ÃƒÆ’Ã‚Â¢ÃƒÂ¢Ã¢â‚¬Å¡Ã‚Â¬Ãƒâ€¦Ã‚Â¡ÃƒÆ’Ã†â€™ÃƒÂ¢Ã¢â€šÂ¬Ã…Â¡ÃƒÆ’Ã¢â‚¬Å¡Ãƒâ€šÃ‚Â¢ÃƒÆ’Ã†â€™Ãƒâ€ Ã¢â‚¬â„¢ÃƒÆ’Ã¢â‚¬Â ÃƒÂ¢Ã¢â€šÂ¬Ã¢â€žÂ¢ÃƒÆ’Ã†â€™ÃƒÂ¢Ã¢â€šÂ¬Ã‚Â ÃƒÆ’Ã‚Â¢ÃƒÂ¢Ã¢â‚¬Å¡Ã‚Â¬ÃƒÂ¢Ã¢â‚¬Å¾Ã‚Â¢ÃƒÆ’Ã†â€™Ãƒâ€ Ã¢â‚¬â„¢ÃƒÆ’Ã‚Â¢ÃƒÂ¢Ã¢â‚¬Å¡Ã‚Â¬Ãƒâ€šÃ‚Â ÃƒÆ’Ã†â€™Ãƒâ€šÃ‚Â¢ÃƒÆ’Ã‚Â¢ÃƒÂ¢Ã¢â€šÂ¬Ã…Â¡Ãƒâ€šÃ‚Â¬ÃƒÆ’Ã‚Â¢ÃƒÂ¢Ã¢â€šÂ¬Ã…Â¾Ãƒâ€šÃ‚Â¢ÃƒÆ’Ã†â€™Ãƒâ€ Ã¢â‚¬â„¢ÃƒÆ’Ã¢â‚¬Â ÃƒÂ¢Ã¢â€šÂ¬Ã¢â€žÂ¢ÃƒÆ’Ã†â€™ÃƒÂ¢Ã¢â€šÂ¬Ã…Â¡ÃƒÆ’Ã¢â‚¬Å¡Ãƒâ€šÃ‚Â¢ÃƒÆ’Ã†â€™Ãƒâ€ Ã¢â‚¬â„¢ÃƒÆ’Ã¢â‚¬Å¡Ãƒâ€šÃ‚Â¢ÃƒÆ’Ã†â€™Ãƒâ€šÃ‚Â¢ÃƒÆ’Ã‚Â¢ÃƒÂ¢Ã¢â€šÂ¬Ã…Â¡Ãƒâ€šÃ‚Â¬ÃƒÆ’Ã¢â‚¬Â¦Ãƒâ€šÃ‚Â¡ÃƒÆ’Ã†â€™ÃƒÂ¢Ã¢â€šÂ¬Ã…Â¡ÃƒÆ’Ã¢â‚¬Å¡Ãƒâ€šÃ‚Â¬ÃƒÆ’Ã†â€™Ãƒâ€ Ã¢â‚¬â„¢ÃƒÆ’Ã‚Â¢ÃƒÂ¢Ã¢â‚¬Å¡Ã‚Â¬Ãƒâ€šÃ‚Â¦ÃƒÆ’Ã†â€™ÃƒÂ¢Ã¢â€šÂ¬Ã…Â¡ÃƒÆ’Ã¢â‚¬Å¡Ãƒâ€šÃ‚Â¡ÃƒÆ’Ã†â€™Ãƒâ€ Ã¢â‚¬â„¢ÃƒÆ’Ã¢â‚¬Â ÃƒÂ¢Ã¢â€šÂ¬Ã¢â€žÂ¢ÃƒÆ’Ã†â€™ÃƒÂ¢Ã¢â€šÂ¬Ã‚Â ÃƒÆ’Ã‚Â¢ÃƒÂ¢Ã¢â‚¬Å¡Ã‚Â¬ÃƒÂ¢Ã¢â‚¬Å¾Ã‚Â¢ÃƒÆ’Ã†â€™Ãƒâ€ Ã¢â‚¬â„¢ÃƒÆ’Ã¢â‚¬Å¡Ãƒâ€šÃ‚Â¢ÃƒÆ’Ã†â€™Ãƒâ€šÃ‚Â¢ÃƒÆ’Ã‚Â¢ÃƒÂ¢Ã¢â‚¬Å¡Ã‚Â¬Ãƒâ€¦Ã‚Â¡ÃƒÆ’Ã¢â‚¬Å¡Ãƒâ€šÃ‚Â¬ÃƒÆ’Ã†â€™ÃƒÂ¢Ã¢â€šÂ¬Ã‚Â¦ÃƒÆ’Ã¢â‚¬Å¡Ãƒâ€šÃ‚Â¡ÃƒÆ’Ã†â€™Ãƒâ€ Ã¢â‚¬â„¢ÃƒÆ’Ã¢â‚¬Â ÃƒÂ¢Ã¢â€šÂ¬Ã¢â€žÂ¢ÃƒÆ’Ã†â€™Ãƒâ€šÃ‚Â¢ÃƒÆ’Ã‚Â¢ÃƒÂ¢Ã¢â€šÂ¬Ã…Â¡Ãƒâ€šÃ‚Â¬ÃƒÆ’Ã¢â‚¬Â¦Ãƒâ€šÃ‚Â¡ÃƒÆ’Ã†â€™Ãƒâ€ Ã¢â‚¬â„¢ÃƒÆ’Ã‚Â¢ÃƒÂ¢Ã¢â‚¬Å¡Ã‚Â¬Ãƒâ€¦Ã‚Â¡ÃƒÆ’Ã†â€™ÃƒÂ¢Ã¢â€šÂ¬Ã…Â¡ÃƒÆ’Ã¢â‚¬Å¡Ãƒâ€šÃ‚ÂÃƒÆ’Ã†â€™Ãƒâ€ Ã¢â‚¬â„¢ÃƒÆ’Ã¢â‚¬Â ÃƒÂ¢Ã¢â€šÂ¬Ã¢â€žÂ¢ÃƒÆ’Ã†â€™ÃƒÂ¢Ã¢â€šÂ¬Ã‚Â ÃƒÆ’Ã‚Â¢ÃƒÂ¢Ã¢â‚¬Å¡Ã‚Â¬ÃƒÂ¢Ã¢â‚¬Å¾Ã‚Â¢ÃƒÆ’Ã†â€™Ãƒâ€ Ã¢â‚¬â„¢ÃƒÆ’Ã‚Â¢ÃƒÂ¢Ã¢â‚¬Å¡Ã‚Â¬Ãƒâ€šÃ‚Â ÃƒÆ’Ã†â€™Ãƒâ€šÃ‚Â¢ÃƒÆ’Ã‚Â¢ÃƒÂ¢Ã¢â€šÂ¬Ã…Â¡Ãƒâ€šÃ‚Â¬ÃƒÆ’Ã‚Â¢ÃƒÂ¢Ã¢â€šÂ¬Ã…Â¾Ãƒâ€šÃ‚Â¢ÃƒÆ’Ã†â€™Ãƒâ€ Ã¢â‚¬â„¢ÃƒÆ’Ã¢â‚¬Â ÃƒÂ¢Ã¢â€šÂ¬Ã¢â€žÂ¢ÃƒÆ’Ã†â€™ÃƒÂ¢Ã¢â€šÂ¬Ã…Â¡ÃƒÆ’Ã¢â‚¬Å¡Ãƒâ€šÃ‚Â¢ÃƒÆ’Ã†â€™Ãƒâ€ Ã¢â‚¬â„¢ÃƒÆ’Ã¢â‚¬Å¡Ãƒâ€šÃ‚Â¢ÃƒÆ’Ã†â€™Ãƒâ€šÃ‚Â¢ÃƒÆ’Ã‚Â¢ÃƒÂ¢Ã¢â€šÂ¬Ã…Â¡Ãƒâ€šÃ‚Â¬ÃƒÆ’Ã¢â‚¬Â¦Ãƒâ€šÃ‚Â¡ÃƒÆ’Ã†â€™ÃƒÂ¢Ã¢â€šÂ¬Ã…Â¡ÃƒÆ’Ã¢â‚¬Å¡Ãƒâ€šÃ‚Â¬ÃƒÆ’Ã†â€™Ãƒâ€ Ã¢â‚¬â„¢ÃƒÆ’Ã‚Â¢ÃƒÂ¢Ã¢â‚¬Å¡Ã‚Â¬Ãƒâ€šÃ‚Â¦ÃƒÆ’Ã†â€™ÃƒÂ¢Ã¢â€šÂ¬Ã…Â¡ÃƒÆ’Ã¢â‚¬Å¡Ãƒâ€šÃ‚Â¡ÃƒÆ’Ã†â€™Ãƒâ€ Ã¢â‚¬â„¢ÃƒÆ’Ã¢â‚¬Â ÃƒÂ¢Ã¢â€šÂ¬Ã¢â€žÂ¢ÃƒÆ’Ã†â€™ÃƒÂ¢Ã¢â€šÂ¬Ã‚Â ÃƒÆ’Ã‚Â¢ÃƒÂ¢Ã¢â‚¬Å¡Ã‚Â¬ÃƒÂ¢Ã¢â‚¬Å¾Ã‚Â¢ÃƒÆ’Ã†â€™Ãƒâ€ Ã¢â‚¬â„¢ÃƒÆ’Ã¢â‚¬Å¡Ãƒâ€šÃ‚Â¢ÃƒÆ’Ã†â€™Ãƒâ€šÃ‚Â¢ÃƒÆ’Ã‚Â¢ÃƒÂ¢Ã¢â‚¬Å¡Ã‚Â¬Ãƒâ€¦Ã‚Â¡ÃƒÆ’Ã¢â‚¬Å¡Ãƒâ€šÃ‚Â¬ÃƒÆ’Ã†â€™ÃƒÂ¢Ã¢â€šÂ¬Ã‚Â¦ÃƒÆ’Ã¢â‚¬Å¡Ãƒâ€šÃ‚Â¡ÃƒÆ’Ã†â€™Ãƒâ€ Ã¢â‚¬â„¢ÃƒÆ’Ã¢â‚¬Â ÃƒÂ¢Ã¢â€šÂ¬Ã¢â€žÂ¢ÃƒÆ’Ã†â€™Ãƒâ€šÃ‚Â¢ÃƒÆ’Ã‚Â¢ÃƒÂ¢Ã¢â€šÂ¬Ã…Â¡Ãƒâ€šÃ‚Â¬ÃƒÆ’Ã¢â‚¬Â¦Ãƒâ€šÃ‚Â¡ÃƒÆ’Ã†â€™Ãƒâ€ Ã¢â‚¬â„¢ÃƒÆ’Ã‚Â¢ÃƒÂ¢Ã¢â‚¬Å¡Ã‚Â¬Ãƒâ€¦Ã‚Â¡ÃƒÆ’Ã†â€™ÃƒÂ¢Ã¢â€šÂ¬Ã…Â¡ÃƒÆ’Ã¢â‚¬Å¡Ãƒâ€šÃ‚Â»-N) concentration (</w:t>
       </w:r>
       <w:proofErr w:type="spellStart"/>
       <w:r>
@@ -8560,7 +8560,7 @@
           <w:sz w:val="28"/>
           <w:szCs w:val="28"/>
         </w:rPr>
-        <w:t>ÃƒÆ’Ã†â€™Ãƒâ€ Ã¢â‚¬â„¢ÃƒÆ’Ã¢â‚¬Â ÃƒÂ¢Ã¢â€šÂ¬Ã¢â€žÂ¢ÃƒÆ’Ã†â€™ÃƒÂ¢Ã¢â€šÂ¬Ã‚Â ÃƒÆ’Ã‚Â¢ÃƒÂ¢Ã¢â‚¬Å¡Ã‚Â¬ÃƒÂ¢Ã¢â‚¬Å¾Ã‚Â¢ÃƒÆ’Ã†â€™Ãƒâ€ Ã¢â‚¬â„¢ÃƒÆ’Ã‚Â¢ÃƒÂ¢Ã¢â‚¬Å¡Ã‚Â¬Ãƒâ€šÃ‚Â¦ÃƒÆ’Ã†â€™ÃƒÂ¢Ã¢â€šÂ¬Ã…Â¡ÃƒÆ’Ã¢â‚¬Å¡Ãƒâ€šÃ‚Â½ÃƒÆ’Ã†â€™Ãƒâ€ Ã¢â‚¬â„¢ÃƒÆ’Ã¢â‚¬Â ÃƒÂ¢Ã¢â€šÂ¬Ã¢â€žÂ¢ÃƒÆ’Ã†â€™Ãƒâ€šÃ‚Â¢ÃƒÆ’Ã‚Â¢ÃƒÂ¢Ã¢â€šÂ¬Ã…Â¡Ãƒâ€šÃ‚Â¬ÃƒÆ’Ã¢â‚¬Â¦Ãƒâ€šÃ‚Â¡ÃƒÆ’Ã†â€™Ãƒâ€ Ã¢â‚¬â„¢ÃƒÆ’Ã‚Â¢ÃƒÂ¢Ã¢â‚¬Å¡Ã‚Â¬Ãƒâ€¦Ã‚Â¡ÃƒÆ’Ã†â€™ÃƒÂ¢Ã¢â€šÂ¬Ã…Â¡ÃƒÆ’Ã¢â‚¬Å¡Ãƒâ€šÃ‚Â¼g</w:t>
+        <w:t>ÃƒÆ’Ã†â€™Ãƒâ€ Ã¢â‚¬â„¢ÃƒÆ’Ã¢â‚¬Â ÃƒÂ¢Ã¢â€šÂ¬Ã¢â€žÂ¢ÃƒÆ’Ã†â€™ÃƒÂ¢Ã¢â€šÂ¬Ã‚Â ÃƒÆ’Ã‚Â¢ÃƒÂ¢Ã¢â‚¬Å¡Ã‚Â¬ÃƒÂ¢Ã¢â‚¬Å¾Ã‚Â¢ÃƒÆ’Ã†â€™Ãƒâ€ Ã¢â‚¬â„¢ÃƒÆ’Ã‚Â¢ÃƒÂ¢Ã¢â‚¬Å¡Ã‚Â¬Ãƒâ€šÃ‚Â ÃƒÆ’Ã†â€™Ãƒâ€šÃ‚Â¢ÃƒÆ’Ã‚Â¢ÃƒÂ¢Ã¢â€šÂ¬Ã…Â¡Ãƒâ€šÃ‚Â¬ÃƒÆ’Ã‚Â¢ÃƒÂ¢Ã¢â€šÂ¬Ã…Â¾Ãƒâ€šÃ‚Â¢ÃƒÆ’Ã†â€™Ãƒâ€ Ã¢â‚¬â„¢ÃƒÆ’Ã¢â‚¬Â ÃƒÂ¢Ã¢â€šÂ¬Ã¢â€žÂ¢ÃƒÆ’Ã†â€™Ãƒâ€šÃ‚Â¢ÃƒÆ’Ã‚Â¢ÃƒÂ¢Ã¢â€šÂ¬Ã…Â¡Ãƒâ€šÃ‚Â¬ÃƒÆ’Ã¢â‚¬Å¡Ãƒâ€šÃ‚Â ÃƒÆ’Ã†â€™Ãƒâ€ Ã¢â‚¬â„¢ÃƒÆ’Ã¢â‚¬Å¡Ãƒâ€šÃ‚Â¢ÃƒÆ’Ã†â€™Ãƒâ€šÃ‚Â¢ÃƒÆ’Ã‚Â¢ÃƒÂ¢Ã¢â‚¬Å¡Ã‚Â¬Ãƒâ€¦Ã‚Â¡ÃƒÆ’Ã¢â‚¬Å¡Ãƒâ€šÃ‚Â¬ÃƒÆ’Ã†â€™Ãƒâ€šÃ‚Â¢ÃƒÆ’Ã‚Â¢ÃƒÂ¢Ã¢â‚¬Å¡Ã‚Â¬Ãƒâ€¦Ã‚Â¾ÃƒÆ’Ã¢â‚¬Å¡Ãƒâ€šÃ‚Â¢ÃƒÆ’Ã†â€™Ãƒâ€ Ã¢â‚¬â„¢ÃƒÆ’Ã¢â‚¬Â ÃƒÂ¢Ã¢â€šÂ¬Ã¢â€žÂ¢ÃƒÆ’Ã†â€™ÃƒÂ¢Ã¢â€šÂ¬Ã‚Â ÃƒÆ’Ã‚Â¢ÃƒÂ¢Ã¢â‚¬Å¡Ã‚Â¬ÃƒÂ¢Ã¢â‚¬Å¾Ã‚Â¢ÃƒÆ’Ã†â€™Ãƒâ€ Ã¢â‚¬â„¢ÃƒÆ’Ã¢â‚¬Å¡Ãƒâ€šÃ‚Â¢ÃƒÆ’Ã†â€™Ãƒâ€šÃ‚Â¢ÃƒÆ’Ã‚Â¢ÃƒÂ¢Ã¢â‚¬Å¡Ã‚Â¬Ãƒâ€¦Ã‚Â¡ÃƒÆ’Ã¢â‚¬Å¡Ãƒâ€šÃ‚Â¬ÃƒÆ’Ã†â€™ÃƒÂ¢Ã¢â€šÂ¬Ã…Â¡ÃƒÆ’Ã¢â‚¬Å¡Ãƒâ€šÃ‚Â¦ÃƒÆ’Ã†â€™Ãƒâ€ Ã¢â‚¬â„¢ÃƒÆ’Ã¢â‚¬Â ÃƒÂ¢Ã¢â€šÂ¬Ã¢â€žÂ¢ÃƒÆ’Ã†â€™Ãƒâ€šÃ‚Â¢ÃƒÆ’Ã‚Â¢ÃƒÂ¢Ã¢â€šÂ¬Ã…Â¡Ãƒâ€šÃ‚Â¬ÃƒÆ’Ã¢â‚¬Â¦Ãƒâ€šÃ‚Â¡ÃƒÆ’Ã†â€™Ãƒâ€ Ã¢â‚¬â„¢ÃƒÆ’Ã‚Â¢ÃƒÂ¢Ã¢â‚¬Å¡Ã‚Â¬Ãƒâ€¦Ã‚Â¡ÃƒÆ’Ã†â€™ÃƒÂ¢Ã¢â€šÂ¬Ã…Â¡ÃƒÆ’Ã¢â‚¬Å¡Ãƒâ€šÃ‚Â½ÃƒÆ’Ã†â€™Ãƒâ€ Ã¢â‚¬â„¢ÃƒÆ’Ã¢â‚¬Â ÃƒÂ¢Ã¢â€šÂ¬Ã¢â€žÂ¢ÃƒÆ’Ã†â€™ÃƒÂ¢Ã¢â€šÂ¬Ã‚Â ÃƒÆ’Ã‚Â¢ÃƒÂ¢Ã¢â‚¬Å¡Ã‚Â¬ÃƒÂ¢Ã¢â‚¬Å¾Ã‚Â¢ÃƒÆ’Ã†â€™Ãƒâ€ Ã¢â‚¬â„¢ÃƒÆ’Ã‚Â¢ÃƒÂ¢Ã¢â‚¬Å¡Ã‚Â¬Ãƒâ€šÃ‚Â ÃƒÆ’Ã†â€™Ãƒâ€šÃ‚Â¢ÃƒÆ’Ã‚Â¢ÃƒÂ¢Ã¢â€šÂ¬Ã…Â¡Ãƒâ€šÃ‚Â¬ÃƒÆ’Ã‚Â¢ÃƒÂ¢Ã¢â€šÂ¬Ã…Â¾Ãƒâ€šÃ‚Â¢ÃƒÆ’Ã†â€™Ãƒâ€ Ã¢â‚¬â„¢ÃƒÆ’Ã¢â‚¬Â ÃƒÂ¢Ã¢â€šÂ¬Ã¢â€žÂ¢ÃƒÆ’Ã†â€™ÃƒÂ¢Ã¢â€šÂ¬Ã…Â¡ÃƒÆ’Ã¢â‚¬Å¡Ãƒâ€šÃ‚Â¢ÃƒÆ’Ã†â€™Ãƒâ€ Ã¢â‚¬â„¢ÃƒÆ’Ã¢â‚¬Å¡Ãƒâ€šÃ‚Â¢ÃƒÆ’Ã†â€™Ãƒâ€šÃ‚Â¢ÃƒÆ’Ã‚Â¢ÃƒÂ¢Ã¢â€šÂ¬Ã…Â¡Ãƒâ€šÃ‚Â¬ÃƒÆ’Ã¢â‚¬Â¦Ãƒâ€šÃ‚Â¡ÃƒÆ’Ã†â€™ÃƒÂ¢Ã¢â€šÂ¬Ã…Â¡ÃƒÆ’Ã¢â‚¬Å¡Ãƒâ€šÃ‚Â¬ÃƒÆ’Ã†â€™Ãƒâ€ Ã¢â‚¬â„¢ÃƒÆ’Ã‚Â¢ÃƒÂ¢Ã¢â‚¬Å¡Ã‚Â¬Ãƒâ€šÃ‚Â¦ÃƒÆ’Ã†â€™ÃƒÂ¢Ã¢â€šÂ¬Ã…Â¡ÃƒÆ’Ã¢â‚¬Å¡Ãƒâ€šÃ‚Â¡ÃƒÆ’Ã†â€™Ãƒâ€ Ã¢â‚¬â„¢ÃƒÆ’Ã¢â‚¬Â ÃƒÂ¢Ã¢â€šÂ¬Ã¢â€žÂ¢ÃƒÆ’Ã†â€™ÃƒÂ¢Ã¢â€šÂ¬Ã‚Â ÃƒÆ’Ã‚Â¢ÃƒÂ¢Ã¢â‚¬Å¡Ã‚Â¬ÃƒÂ¢Ã¢â‚¬Å¾Ã‚Â¢ÃƒÆ’Ã†â€™Ãƒâ€ Ã¢â‚¬â„¢ÃƒÆ’Ã¢â‚¬Å¡Ãƒâ€šÃ‚Â¢ÃƒÆ’Ã†â€™Ãƒâ€šÃ‚Â¢ÃƒÆ’Ã‚Â¢ÃƒÂ¢Ã¢â‚¬Å¡Ã‚Â¬Ãƒâ€¦Ã‚Â¡ÃƒÆ’Ã¢â‚¬Å¡Ãƒâ€šÃ‚Â¬ÃƒÆ’Ã†â€™ÃƒÂ¢Ã¢â€šÂ¬Ã‚Â¦ÃƒÆ’Ã¢â‚¬Å¡Ãƒâ€šÃ‚Â¡ÃƒÆ’Ã†â€™Ãƒâ€ Ã¢â‚¬â„¢ÃƒÆ’Ã¢â‚¬Â ÃƒÂ¢Ã¢â€šÂ¬Ã¢â€žÂ¢ÃƒÆ’Ã†â€™Ãƒâ€šÃ‚Â¢ÃƒÆ’Ã‚Â¢ÃƒÂ¢Ã¢â€šÂ¬Ã…Â¡Ãƒâ€šÃ‚Â¬ÃƒÆ’Ã¢â‚¬Â¦Ãƒâ€šÃ‚Â¡ÃƒÆ’Ã†â€™Ãƒâ€ Ã¢â‚¬â„¢ÃƒÆ’Ã‚Â¢ÃƒÂ¢Ã¢â‚¬Å¡Ã‚Â¬Ãƒâ€¦Ã‚Â¡ÃƒÆ’Ã†â€™ÃƒÂ¢Ã¢â€šÂ¬Ã…Â¡ÃƒÆ’Ã¢â‚¬Å¡Ãƒâ€šÃ‚Â¼g</w:t>
       </w:r>
       <w:proofErr w:type="spellEnd"/>
       <w:r>
@@ -8578,7 +8578,7 @@
           <w:sz w:val="28"/>
           <w:szCs w:val="28"/>
         </w:rPr>
-        <w:t>ÃƒÆ’Ã†â€™Ãƒâ€ Ã¢â‚¬â„¢ÃƒÆ’Ã¢â‚¬Â ÃƒÂ¢Ã¢â€šÂ¬Ã¢â€žÂ¢ÃƒÆ’Ã†â€™ÃƒÂ¢Ã¢â€šÂ¬Ã‚Â ÃƒÆ’Ã‚Â¢ÃƒÂ¢Ã¢â‚¬Å¡Ã‚Â¬ÃƒÂ¢Ã¢â‚¬Å¾Ã‚Â¢ÃƒÆ’Ã†â€™Ãƒâ€ Ã¢â‚¬â„¢ÃƒÆ’Ã‚Â¢ÃƒÂ¢Ã¢â‚¬Å¡Ã‚Â¬Ãƒâ€šÃ‚Â¦ÃƒÆ’Ã†â€™ÃƒÂ¢Ã¢â€šÂ¬Ã…Â¡ÃƒÆ’Ã¢â‚¬Å¡Ãƒâ€šÃ‚Â½ÃƒÆ’Ã†â€™Ãƒâ€ Ã¢â‚¬â„¢ÃƒÆ’Ã¢â‚¬Â ÃƒÂ¢Ã¢â€šÂ¬Ã¢â€žÂ¢ÃƒÆ’Ã†â€™Ãƒâ€šÃ‚Â¢ÃƒÆ’Ã‚Â¢ÃƒÂ¢Ã¢â€šÂ¬Ã…Â¡Ãƒâ€šÃ‚Â¬ÃƒÆ’Ã¢â‚¬Â¦Ãƒâ€šÃ‚Â¡ÃƒÆ’Ã†â€™Ãƒâ€ Ã¢â‚¬â„¢ÃƒÆ’Ã‚Â¢ÃƒÂ¢Ã¢â‚¬Å¡Ã‚Â¬Ãƒâ€¦Ã‚Â¡ÃƒÆ’Ã†â€™ÃƒÂ¢Ã¢â€šÂ¬Ã…Â¡ÃƒÆ’Ã¢â‚¬Å¡Ãƒâ€šÃ‚Â¼g</w:t>
+        <w:t>ÃƒÆ’Ã†â€™Ãƒâ€ Ã¢â‚¬â„¢ÃƒÆ’Ã¢â‚¬Â ÃƒÂ¢Ã¢â€šÂ¬Ã¢â€žÂ¢ÃƒÆ’Ã†â€™ÃƒÂ¢Ã¢â€šÂ¬Ã‚Â ÃƒÆ’Ã‚Â¢ÃƒÂ¢Ã¢â‚¬Å¡Ã‚Â¬ÃƒÂ¢Ã¢â‚¬Å¾Ã‚Â¢ÃƒÆ’Ã†â€™Ãƒâ€ Ã¢â‚¬â„¢ÃƒÆ’Ã‚Â¢ÃƒÂ¢Ã¢â‚¬Å¡Ã‚Â¬Ãƒâ€šÃ‚Â ÃƒÆ’Ã†â€™Ãƒâ€šÃ‚Â¢ÃƒÆ’Ã‚Â¢ÃƒÂ¢Ã¢â€šÂ¬Ã…Â¡Ãƒâ€šÃ‚Â¬ÃƒÆ’Ã‚Â¢ÃƒÂ¢Ã¢â€šÂ¬Ã…Â¾Ãƒâ€šÃ‚Â¢ÃƒÆ’Ã†â€™Ãƒâ€ Ã¢â‚¬â„¢ÃƒÆ’Ã¢â‚¬Â ÃƒÂ¢Ã¢â€šÂ¬Ã¢â€žÂ¢ÃƒÆ’Ã†â€™Ãƒâ€šÃ‚Â¢ÃƒÆ’Ã‚Â¢ÃƒÂ¢Ã¢â€šÂ¬Ã…Â¡Ãƒâ€šÃ‚Â¬ÃƒÆ’Ã¢â‚¬Å¡Ãƒâ€šÃ‚Â ÃƒÆ’Ã†â€™Ãƒâ€ Ã¢â‚¬â„¢ÃƒÆ’Ã¢â‚¬Å¡Ãƒâ€šÃ‚Â¢ÃƒÆ’Ã†â€™Ãƒâ€šÃ‚Â¢ÃƒÆ’Ã‚Â¢ÃƒÂ¢Ã¢â‚¬Å¡Ã‚Â¬Ãƒâ€¦Ã‚Â¡ÃƒÆ’Ã¢â‚¬Å¡Ãƒâ€šÃ‚Â¬ÃƒÆ’Ã†â€™Ãƒâ€šÃ‚Â¢ÃƒÆ’Ã‚Â¢ÃƒÂ¢Ã¢â‚¬Å¡Ã‚Â¬Ãƒâ€¦Ã‚Â¾ÃƒÆ’Ã¢â‚¬Å¡Ãƒâ€šÃ‚Â¢ÃƒÆ’Ã†â€™Ãƒâ€ Ã¢â‚¬â„¢ÃƒÆ’Ã¢â‚¬Â ÃƒÂ¢Ã¢â€šÂ¬Ã¢â€žÂ¢ÃƒÆ’Ã†â€™ÃƒÂ¢Ã¢â€šÂ¬Ã‚Â ÃƒÆ’Ã‚Â¢ÃƒÂ¢Ã¢â‚¬Å¡Ã‚Â¬ÃƒÂ¢Ã¢â‚¬Å¾Ã‚Â¢ÃƒÆ’Ã†â€™Ãƒâ€ Ã¢â‚¬â„¢ÃƒÆ’Ã¢â‚¬Å¡Ãƒâ€šÃ‚Â¢ÃƒÆ’Ã†â€™Ãƒâ€šÃ‚Â¢ÃƒÆ’Ã‚Â¢ÃƒÂ¢Ã¢â‚¬Å¡Ã‚Â¬Ãƒâ€¦Ã‚Â¡ÃƒÆ’Ã¢â‚¬Å¡Ãƒâ€šÃ‚Â¬ÃƒÆ’Ã†â€™ÃƒÂ¢Ã¢â€šÂ¬Ã…Â¡ÃƒÆ’Ã¢â‚¬Å¡Ãƒâ€šÃ‚Â¦ÃƒÆ’Ã†â€™Ãƒâ€ Ã¢â‚¬â„¢ÃƒÆ’Ã¢â‚¬Â ÃƒÂ¢Ã¢â€šÂ¬Ã¢â€žÂ¢ÃƒÆ’Ã†â€™Ãƒâ€šÃ‚Â¢ÃƒÆ’Ã‚Â¢ÃƒÂ¢Ã¢â€šÂ¬Ã…Â¡Ãƒâ€šÃ‚Â¬ÃƒÆ’Ã¢â‚¬Â¦Ãƒâ€šÃ‚Â¡ÃƒÆ’Ã†â€™Ãƒâ€ Ã¢â‚¬â„¢ÃƒÆ’Ã‚Â¢ÃƒÂ¢Ã¢â‚¬Å¡Ã‚Â¬Ãƒâ€¦Ã‚Â¡ÃƒÆ’Ã†â€™ÃƒÂ¢Ã¢â€šÂ¬Ã…Â¡ÃƒÆ’Ã¢â‚¬Å¡Ãƒâ€šÃ‚Â½ÃƒÆ’Ã†â€™Ãƒâ€ Ã¢â‚¬â„¢ÃƒÆ’Ã¢â‚¬Â ÃƒÂ¢Ã¢â€šÂ¬Ã¢â€žÂ¢ÃƒÆ’Ã†â€™ÃƒÂ¢Ã¢â€šÂ¬Ã‚Â ÃƒÆ’Ã‚Â¢ÃƒÂ¢Ã¢â‚¬Å¡Ã‚Â¬ÃƒÂ¢Ã¢â‚¬Å¾Ã‚Â¢ÃƒÆ’Ã†â€™Ãƒâ€ Ã¢â‚¬â„¢ÃƒÆ’Ã‚Â¢ÃƒÂ¢Ã¢â‚¬Å¡Ã‚Â¬Ãƒâ€šÃ‚Â ÃƒÆ’Ã†â€™Ãƒâ€šÃ‚Â¢ÃƒÆ’Ã‚Â¢ÃƒÂ¢Ã¢â€šÂ¬Ã…Â¡Ãƒâ€šÃ‚Â¬ÃƒÆ’Ã‚Â¢ÃƒÂ¢Ã¢â€šÂ¬Ã…Â¾Ãƒâ€šÃ‚Â¢ÃƒÆ’Ã†â€™Ãƒâ€ Ã¢â‚¬â„¢ÃƒÆ’Ã¢â‚¬Â ÃƒÂ¢Ã¢â€šÂ¬Ã¢â€žÂ¢ÃƒÆ’Ã†â€™ÃƒÂ¢Ã¢â€šÂ¬Ã…Â¡ÃƒÆ’Ã¢â‚¬Å¡Ãƒâ€šÃ‚Â¢ÃƒÆ’Ã†â€™Ãƒâ€ Ã¢â‚¬â„¢ÃƒÆ’Ã¢â‚¬Å¡Ãƒâ€šÃ‚Â¢ÃƒÆ’Ã†â€™Ãƒâ€šÃ‚Â¢ÃƒÆ’Ã‚Â¢ÃƒÂ¢Ã¢â€šÂ¬Ã…Â¡Ãƒâ€šÃ‚Â¬ÃƒÆ’Ã¢â‚¬Â¦Ãƒâ€šÃ‚Â¡ÃƒÆ’Ã†â€™ÃƒÂ¢Ã¢â€šÂ¬Ã…Â¡ÃƒÆ’Ã¢â‚¬Å¡Ãƒâ€šÃ‚Â¬ÃƒÆ’Ã†â€™Ãƒâ€ Ã¢â‚¬â„¢ÃƒÆ’Ã‚Â¢ÃƒÂ¢Ã¢â‚¬Å¡Ã‚Â¬Ãƒâ€šÃ‚Â¦ÃƒÆ’Ã†â€™ÃƒÂ¢Ã¢â€šÂ¬Ã…Â¡ÃƒÆ’Ã¢â‚¬Å¡Ãƒâ€šÃ‚Â¡ÃƒÆ’Ã†â€™Ãƒâ€ Ã¢â‚¬â„¢ÃƒÆ’Ã¢â‚¬Â ÃƒÂ¢Ã¢â€šÂ¬Ã¢â€žÂ¢ÃƒÆ’Ã†â€™ÃƒÂ¢Ã¢â€šÂ¬Ã‚Â ÃƒÆ’Ã‚Â¢ÃƒÂ¢Ã¢â‚¬Å¡Ã‚Â¬ÃƒÂ¢Ã¢â‚¬Å¾Ã‚Â¢ÃƒÆ’Ã†â€™Ãƒâ€ Ã¢â‚¬â„¢ÃƒÆ’Ã¢â‚¬Å¡Ãƒâ€šÃ‚Â¢ÃƒÆ’Ã†â€™Ãƒâ€šÃ‚Â¢ÃƒÆ’Ã‚Â¢ÃƒÂ¢Ã¢â‚¬Å¡Ã‚Â¬Ãƒâ€¦Ã‚Â¡ÃƒÆ’Ã¢â‚¬Å¡Ãƒâ€šÃ‚Â¬ÃƒÆ’Ã†â€™ÃƒÂ¢Ã¢â€šÂ¬Ã‚Â¦ÃƒÆ’Ã¢â‚¬Å¡Ãƒâ€šÃ‚Â¡ÃƒÆ’Ã†â€™Ãƒâ€ Ã¢â‚¬â„¢ÃƒÆ’Ã¢â‚¬Â ÃƒÂ¢Ã¢â€šÂ¬Ã¢â€žÂ¢ÃƒÆ’Ã†â€™Ãƒâ€šÃ‚Â¢ÃƒÆ’Ã‚Â¢ÃƒÂ¢Ã¢â€šÂ¬Ã…Â¡Ãƒâ€šÃ‚Â¬ÃƒÆ’Ã¢â‚¬Â¦Ãƒâ€šÃ‚Â¡ÃƒÆ’Ã†â€™Ãƒâ€ Ã¢â‚¬â„¢ÃƒÆ’Ã‚Â¢ÃƒÂ¢Ã¢â‚¬Å¡Ã‚Â¬Ãƒâ€¦Ã‚Â¡ÃƒÆ’Ã†â€™ÃƒÂ¢Ã¢â€šÂ¬Ã…Â¡ÃƒÆ’Ã¢â‚¬Å¡Ãƒâ€šÃ‚Â¼g</w:t>
       </w:r>
       <w:proofErr w:type="spellEnd"/>
       <w:r>
@@ -8596,7 +8596,7 @@
           <w:sz w:val="28"/>
           <w:szCs w:val="28"/>
         </w:rPr>
-        <w:t>ÃƒÆ’Ã†â€™Ãƒâ€ Ã¢â‚¬â„¢ÃƒÆ’Ã¢â‚¬Â ÃƒÂ¢Ã¢â€šÂ¬Ã¢â€žÂ¢ÃƒÆ’Ã†â€™ÃƒÂ¢Ã¢â€šÂ¬Ã‚Â ÃƒÆ’Ã‚Â¢ÃƒÂ¢Ã¢â‚¬Å¡Ã‚Â¬ÃƒÂ¢Ã¢â‚¬Å¾Ã‚Â¢ÃƒÆ’Ã†â€™Ãƒâ€ Ã¢â‚¬â„¢ÃƒÆ’Ã‚Â¢ÃƒÂ¢Ã¢â‚¬Å¡Ã‚Â¬Ãƒâ€šÃ‚Â¦ÃƒÆ’Ã†â€™ÃƒÂ¢Ã¢â€šÂ¬Ã…Â¡ÃƒÆ’Ã¢â‚¬Å¡Ãƒâ€šÃ‚Â½ÃƒÆ’Ã†â€™Ãƒâ€ Ã¢â‚¬â„¢ÃƒÆ’Ã¢â‚¬Â ÃƒÂ¢Ã¢â€šÂ¬Ã¢â€žÂ¢ÃƒÆ’Ã†â€™Ãƒâ€šÃ‚Â¢ÃƒÆ’Ã‚Â¢ÃƒÂ¢Ã¢â€šÂ¬Ã…Â¡Ãƒâ€šÃ‚Â¬ÃƒÆ’Ã¢â‚¬Â¦Ãƒâ€šÃ‚Â¡ÃƒÆ’Ã†â€™Ãƒâ€ Ã¢â‚¬â„¢ÃƒÆ’Ã‚Â¢ÃƒÂ¢Ã¢â‚¬Å¡Ã‚Â¬Ãƒâ€¦Ã‚Â¡ÃƒÆ’Ã†â€™ÃƒÂ¢Ã¢â€šÂ¬Ã…Â¡ÃƒÆ’Ã¢â‚¬Å¡Ãƒâ€šÃ‚Â¼g</w:t>
+        <w:t>ÃƒÆ’Ã†â€™Ãƒâ€ Ã¢â‚¬â„¢ÃƒÆ’Ã¢â‚¬Â ÃƒÂ¢Ã¢â€šÂ¬Ã¢â€žÂ¢ÃƒÆ’Ã†â€™ÃƒÂ¢Ã¢â€šÂ¬Ã‚Â ÃƒÆ’Ã‚Â¢ÃƒÂ¢Ã¢â‚¬Å¡Ã‚Â¬ÃƒÂ¢Ã¢â‚¬Å¾Ã‚Â¢ÃƒÆ’Ã†â€™Ãƒâ€ Ã¢â‚¬â„¢ÃƒÆ’Ã‚Â¢ÃƒÂ¢Ã¢â‚¬Å¡Ã‚Â¬Ãƒâ€šÃ‚Â ÃƒÆ’Ã†â€™Ãƒâ€šÃ‚Â¢ÃƒÆ’Ã‚Â¢ÃƒÂ¢Ã¢â€šÂ¬Ã…Â¡Ãƒâ€šÃ‚Â¬ÃƒÆ’Ã‚Â¢ÃƒÂ¢Ã¢â€šÂ¬Ã…Â¾Ãƒâ€šÃ‚Â¢ÃƒÆ’Ã†â€™Ãƒâ€ Ã¢â‚¬â„¢ÃƒÆ’Ã¢â‚¬Â ÃƒÂ¢Ã¢â€šÂ¬Ã¢â€žÂ¢ÃƒÆ’Ã†â€™Ãƒâ€šÃ‚Â¢ÃƒÆ’Ã‚Â¢ÃƒÂ¢Ã¢â€šÂ¬Ã…Â¡Ãƒâ€šÃ‚Â¬ÃƒÆ’Ã¢â‚¬Å¡Ãƒâ€šÃ‚Â ÃƒÆ’Ã†â€™Ãƒâ€ Ã¢â‚¬â„¢ÃƒÆ’Ã¢â‚¬Å¡Ãƒâ€šÃ‚Â¢ÃƒÆ’Ã†â€™Ãƒâ€šÃ‚Â¢ÃƒÆ’Ã‚Â¢ÃƒÂ¢Ã¢â‚¬Å¡Ã‚Â¬Ãƒâ€¦Ã‚Â¡ÃƒÆ’Ã¢â‚¬Å¡Ãƒâ€šÃ‚Â¬ÃƒÆ’Ã†â€™Ãƒâ€šÃ‚Â¢ÃƒÆ’Ã‚Â¢ÃƒÂ¢Ã¢â‚¬Å¡Ã‚Â¬Ãƒâ€¦Ã‚Â¾ÃƒÆ’Ã¢â‚¬Å¡Ãƒâ€šÃ‚Â¢ÃƒÆ’Ã†â€™Ãƒâ€ Ã¢â‚¬â„¢ÃƒÆ’Ã¢â‚¬Â ÃƒÂ¢Ã¢â€šÂ¬Ã¢â€žÂ¢ÃƒÆ’Ã†â€™ÃƒÂ¢Ã¢â€šÂ¬Ã‚Â ÃƒÆ’Ã‚Â¢ÃƒÂ¢Ã¢â‚¬Å¡Ã‚Â¬ÃƒÂ¢Ã¢â‚¬Å¾Ã‚Â¢ÃƒÆ’Ã†â€™Ãƒâ€ Ã¢â‚¬â„¢ÃƒÆ’Ã¢â‚¬Å¡Ãƒâ€šÃ‚Â¢ÃƒÆ’Ã†â€™Ãƒâ€šÃ‚Â¢ÃƒÆ’Ã‚Â¢ÃƒÂ¢Ã¢â‚¬Å¡Ã‚Â¬Ãƒâ€¦Ã‚Â¡ÃƒÆ’Ã¢â‚¬Å¡Ãƒâ€šÃ‚Â¬ÃƒÆ’Ã†â€™ÃƒÂ¢Ã¢â€šÂ¬Ã…Â¡ÃƒÆ’Ã¢â‚¬Å¡Ãƒâ€šÃ‚Â¦ÃƒÆ’Ã†â€™Ãƒâ€ Ã¢â‚¬â„¢ÃƒÆ’Ã¢â‚¬Â ÃƒÂ¢Ã¢â€šÂ¬Ã¢â€žÂ¢ÃƒÆ’Ã†â€™Ãƒâ€šÃ‚Â¢ÃƒÆ’Ã‚Â¢ÃƒÂ¢Ã¢â€šÂ¬Ã…Â¡Ãƒâ€šÃ‚Â¬ÃƒÆ’Ã¢â‚¬Â¦Ãƒâ€šÃ‚Â¡ÃƒÆ’Ã†â€™Ãƒâ€ Ã¢â‚¬â„¢ÃƒÆ’Ã‚Â¢ÃƒÂ¢Ã¢â‚¬Å¡Ã‚Â¬Ãƒâ€¦Ã‚Â¡ÃƒÆ’Ã†â€™ÃƒÂ¢Ã¢â€šÂ¬Ã…Â¡ÃƒÆ’Ã¢â‚¬Å¡Ãƒâ€šÃ‚Â½ÃƒÆ’Ã†â€™Ãƒâ€ Ã¢â‚¬â„¢ÃƒÆ’Ã¢â‚¬Â ÃƒÂ¢Ã¢â€šÂ¬Ã¢â€žÂ¢ÃƒÆ’Ã†â€™ÃƒÂ¢Ã¢â€šÂ¬Ã‚Â ÃƒÆ’Ã‚Â¢ÃƒÂ¢Ã¢â‚¬Å¡Ã‚Â¬ÃƒÂ¢Ã¢â‚¬Å¾Ã‚Â¢ÃƒÆ’Ã†â€™Ãƒâ€ Ã¢â‚¬â„¢ÃƒÆ’Ã‚Â¢ÃƒÂ¢Ã¢â‚¬Å¡Ã‚Â¬Ãƒâ€šÃ‚Â ÃƒÆ’Ã†â€™Ãƒâ€šÃ‚Â¢ÃƒÆ’Ã‚Â¢ÃƒÂ¢Ã¢â€šÂ¬Ã…Â¡Ãƒâ€šÃ‚Â¬ÃƒÆ’Ã‚Â¢ÃƒÂ¢Ã¢â€šÂ¬Ã…Â¾Ãƒâ€šÃ‚Â¢ÃƒÆ’Ã†â€™Ãƒâ€ Ã¢â‚¬â„¢ÃƒÆ’Ã¢â‚¬Â ÃƒÂ¢Ã¢â€šÂ¬Ã¢â€žÂ¢ÃƒÆ’Ã†â€™ÃƒÂ¢Ã¢â€šÂ¬Ã…Â¡ÃƒÆ’Ã¢â‚¬Å¡Ãƒâ€šÃ‚Â¢ÃƒÆ’Ã†â€™Ãƒâ€ Ã¢â‚¬â„¢ÃƒÆ’Ã¢â‚¬Å¡Ãƒâ€šÃ‚Â¢ÃƒÆ’Ã†â€™Ãƒâ€šÃ‚Â¢ÃƒÆ’Ã‚Â¢ÃƒÂ¢Ã¢â€šÂ¬Ã…Â¡Ãƒâ€šÃ‚Â¬ÃƒÆ’Ã¢â‚¬Â¦Ãƒâ€šÃ‚Â¡ÃƒÆ’Ã†â€™ÃƒÂ¢Ã¢â€šÂ¬Ã…Â¡ÃƒÆ’Ã¢â‚¬Å¡Ãƒâ€šÃ‚Â¬ÃƒÆ’Ã†â€™Ãƒâ€ Ã¢â‚¬â„¢ÃƒÆ’Ã‚Â¢ÃƒÂ¢Ã¢â‚¬Å¡Ã‚Â¬Ãƒâ€šÃ‚Â¦ÃƒÆ’Ã†â€™ÃƒÂ¢Ã¢â€šÂ¬Ã…Â¡ÃƒÆ’Ã¢â‚¬Å¡Ãƒâ€šÃ‚Â¡ÃƒÆ’Ã†â€™Ãƒâ€ Ã¢â‚¬â„¢ÃƒÆ’Ã¢â‚¬Â ÃƒÂ¢Ã¢â€šÂ¬Ã¢â€žÂ¢ÃƒÆ’Ã†â€™ÃƒÂ¢Ã¢â€šÂ¬Ã‚Â ÃƒÆ’Ã‚Â¢ÃƒÂ¢Ã¢â‚¬Å¡Ã‚Â¬ÃƒÂ¢Ã¢â‚¬Å¾Ã‚Â¢ÃƒÆ’Ã†â€™Ãƒâ€ Ã¢â‚¬â„¢ÃƒÆ’Ã¢â‚¬Å¡Ãƒâ€šÃ‚Â¢ÃƒÆ’Ã†â€™Ãƒâ€šÃ‚Â¢ÃƒÆ’Ã‚Â¢ÃƒÂ¢Ã¢â‚¬Å¡Ã‚Â¬Ãƒâ€¦Ã‚Â¡ÃƒÆ’Ã¢â‚¬Å¡Ãƒâ€šÃ‚Â¬ÃƒÆ’Ã†â€™ÃƒÂ¢Ã¢â€šÂ¬Ã‚Â¦ÃƒÆ’Ã¢â‚¬Å¡Ãƒâ€šÃ‚Â¡ÃƒÆ’Ã†â€™Ãƒâ€ Ã¢â‚¬â„¢ÃƒÆ’Ã¢â‚¬Â ÃƒÂ¢Ã¢â€šÂ¬Ã¢â€žÂ¢ÃƒÆ’Ã†â€™Ãƒâ€šÃ‚Â¢ÃƒÆ’Ã‚Â¢ÃƒÂ¢Ã¢â€šÂ¬Ã…Â¡Ãƒâ€šÃ‚Â¬ÃƒÆ’Ã¢â‚¬Â¦Ãƒâ€šÃ‚Â¡ÃƒÆ’Ã†â€™Ãƒâ€ Ã¢â‚¬â„¢ÃƒÆ’Ã‚Â¢ÃƒÂ¢Ã¢â‚¬Å¡Ã‚Â¬Ãƒâ€¦Ã‚Â¡ÃƒÆ’Ã†â€™ÃƒÂ¢Ã¢â€šÂ¬Ã…Â¡ÃƒÆ’Ã¢â‚¬Å¡Ãƒâ€šÃ‚Â¼g</w:t>
       </w:r>
       <w:proofErr w:type="spellEnd"/>
       <w:r>
@@ -8632,7 +8632,7 @@
           <w:sz w:val="28"/>
           <w:szCs w:val="28"/>
         </w:rPr>
-        <w:t>ÃƒÆ’Ã†â€™Ãƒâ€ Ã¢â‚¬â„¢ÃƒÆ’Ã¢â‚¬Â ÃƒÂ¢Ã¢â€šÂ¬Ã¢â€žÂ¢ÃƒÆ’Ã†â€™ÃƒÂ¢Ã¢â€šÂ¬Ã‚Â ÃƒÆ’Ã‚Â¢ÃƒÂ¢Ã¢â‚¬Å¡Ã‚Â¬ÃƒÂ¢Ã¢â‚¬Å¾Ã‚Â¢ÃƒÆ’Ã†â€™Ãƒâ€ Ã¢â‚¬â„¢ÃƒÆ’Ã‚Â¢ÃƒÂ¢Ã¢â‚¬Å¡Ã‚Â¬Ãƒâ€šÃ‚Â¦ÃƒÆ’Ã†â€™ÃƒÂ¢Ã¢â€šÂ¬Ã…Â¡ÃƒÆ’Ã¢â‚¬Å¡Ãƒâ€šÃ‚Â½ÃƒÆ’Ã†â€™Ãƒâ€ Ã¢â‚¬â„¢ÃƒÆ’Ã¢â‚¬Â ÃƒÂ¢Ã¢â€šÂ¬Ã¢â€žÂ¢ÃƒÆ’Ã†â€™Ãƒâ€šÃ‚Â¢ÃƒÆ’Ã‚Â¢ÃƒÂ¢Ã¢â€šÂ¬Ã…Â¡Ãƒâ€šÃ‚Â¬ÃƒÆ’Ã¢â‚¬Â¦Ãƒâ€šÃ‚Â¡ÃƒÆ’Ã†â€™Ãƒâ€ Ã¢â‚¬â„¢ÃƒÆ’Ã‚Â¢ÃƒÂ¢Ã¢â‚¬Å¡Ã‚Â¬Ãƒâ€¦Ã‚Â¡ÃƒÆ’Ã†â€™ÃƒÂ¢Ã¢â€šÂ¬Ã…Â¡ÃƒÆ’Ã¢â‚¬Å¡Ãƒâ€šÃ‚Â¼g</w:t>
+        <w:t>ÃƒÆ’Ã†â€™Ãƒâ€ Ã¢â‚¬â„¢ÃƒÆ’Ã¢â‚¬Â ÃƒÂ¢Ã¢â€šÂ¬Ã¢â€žÂ¢ÃƒÆ’Ã†â€™ÃƒÂ¢Ã¢â€šÂ¬Ã‚Â ÃƒÆ’Ã‚Â¢ÃƒÂ¢Ã¢â‚¬Å¡Ã‚Â¬ÃƒÂ¢Ã¢â‚¬Å¾Ã‚Â¢ÃƒÆ’Ã†â€™Ãƒâ€ Ã¢â‚¬â„¢ÃƒÆ’Ã‚Â¢ÃƒÂ¢Ã¢â‚¬Å¡Ã‚Â¬Ãƒâ€šÃ‚Â ÃƒÆ’Ã†â€™Ãƒâ€šÃ‚Â¢ÃƒÆ’Ã‚Â¢ÃƒÂ¢Ã¢â€šÂ¬Ã…Â¡Ãƒâ€šÃ‚Â¬ÃƒÆ’Ã‚Â¢ÃƒÂ¢Ã¢â€šÂ¬Ã…Â¾Ãƒâ€šÃ‚Â¢ÃƒÆ’Ã†â€™Ãƒâ€ Ã¢â‚¬â„¢ÃƒÆ’Ã¢â‚¬Â ÃƒÂ¢Ã¢â€šÂ¬Ã¢â€žÂ¢ÃƒÆ’Ã†â€™Ãƒâ€šÃ‚Â¢ÃƒÆ’Ã‚Â¢ÃƒÂ¢Ã¢â€šÂ¬Ã…Â¡Ãƒâ€šÃ‚Â¬ÃƒÆ’Ã¢â‚¬Å¡Ãƒâ€šÃ‚Â ÃƒÆ’Ã†â€™Ãƒâ€ Ã¢â‚¬â„¢ÃƒÆ’Ã¢â‚¬Å¡Ãƒâ€šÃ‚Â¢ÃƒÆ’Ã†â€™Ãƒâ€šÃ‚Â¢ÃƒÆ’Ã‚Â¢ÃƒÂ¢Ã¢â‚¬Å¡Ã‚Â¬Ãƒâ€¦Ã‚Â¡ÃƒÆ’Ã¢â‚¬Å¡Ãƒâ€šÃ‚Â¬ÃƒÆ’Ã†â€™Ãƒâ€šÃ‚Â¢ÃƒÆ’Ã‚Â¢ÃƒÂ¢Ã¢â‚¬Å¡Ã‚Â¬Ãƒâ€¦Ã‚Â¾ÃƒÆ’Ã¢â‚¬Å¡Ãƒâ€šÃ‚Â¢ÃƒÆ’Ã†â€™Ãƒâ€ Ã¢â‚¬â„¢ÃƒÆ’Ã¢â‚¬Â ÃƒÂ¢Ã¢â€šÂ¬Ã¢â€žÂ¢ÃƒÆ’Ã†â€™ÃƒÂ¢Ã¢â€šÂ¬Ã‚Â ÃƒÆ’Ã‚Â¢ÃƒÂ¢Ã¢â‚¬Å¡Ã‚Â¬ÃƒÂ¢Ã¢â‚¬Å¾Ã‚Â¢ÃƒÆ’Ã†â€™Ãƒâ€ Ã¢â‚¬â„¢ÃƒÆ’Ã¢â‚¬Å¡Ãƒâ€šÃ‚Â¢ÃƒÆ’Ã†â€™Ãƒâ€šÃ‚Â¢ÃƒÆ’Ã‚Â¢ÃƒÂ¢Ã¢â‚¬Å¡Ã‚Â¬Ãƒâ€¦Ã‚Â¡ÃƒÆ’Ã¢â‚¬Å¡Ãƒâ€šÃ‚Â¬ÃƒÆ’Ã†â€™ÃƒÂ¢Ã¢â€šÂ¬Ã…Â¡ÃƒÆ’Ã¢â‚¬Å¡Ãƒâ€šÃ‚Â¦ÃƒÆ’Ã†â€™Ãƒâ€ Ã¢â‚¬â„¢ÃƒÆ’Ã¢â‚¬Â ÃƒÂ¢Ã¢â€šÂ¬Ã¢â€žÂ¢ÃƒÆ’Ã†â€™Ãƒâ€šÃ‚Â¢ÃƒÆ’Ã‚Â¢ÃƒÂ¢Ã¢â€šÂ¬Ã…Â¡Ãƒâ€šÃ‚Â¬ÃƒÆ’Ã¢â‚¬Â¦Ãƒâ€šÃ‚Â¡ÃƒÆ’Ã†â€™Ãƒâ€ Ã¢â‚¬â„¢ÃƒÆ’Ã‚Â¢ÃƒÂ¢Ã¢â‚¬Å¡Ã‚Â¬Ãƒâ€¦Ã‚Â¡ÃƒÆ’Ã†â€™ÃƒÂ¢Ã¢â€šÂ¬Ã…Â¡ÃƒÆ’Ã¢â‚¬Å¡Ãƒâ€šÃ‚Â½ÃƒÆ’Ã†â€™Ãƒâ€ Ã¢â‚¬â„¢ÃƒÆ’Ã¢â‚¬Â ÃƒÂ¢Ã¢â€šÂ¬Ã¢â€žÂ¢ÃƒÆ’Ã†â€™ÃƒÂ¢Ã¢â€šÂ¬Ã‚Â ÃƒÆ’Ã‚Â¢ÃƒÂ¢Ã¢â‚¬Å¡Ã‚Â¬ÃƒÂ¢Ã¢â‚¬Å¾Ã‚Â¢ÃƒÆ’Ã†â€™Ãƒâ€ Ã¢â‚¬â„¢ÃƒÆ’Ã‚Â¢ÃƒÂ¢Ã¢â‚¬Å¡Ã‚Â¬Ãƒâ€šÃ‚Â ÃƒÆ’Ã†â€™Ãƒâ€šÃ‚Â¢ÃƒÆ’Ã‚Â¢ÃƒÂ¢Ã¢â€šÂ¬Ã…Â¡Ãƒâ€šÃ‚Â¬ÃƒÆ’Ã‚Â¢ÃƒÂ¢Ã¢â€šÂ¬Ã…Â¾Ãƒâ€šÃ‚Â¢ÃƒÆ’Ã†â€™Ãƒâ€ Ã¢â‚¬â„¢ÃƒÆ’Ã¢â‚¬Â ÃƒÂ¢Ã¢â€šÂ¬Ã¢â€žÂ¢ÃƒÆ’Ã†â€™ÃƒÂ¢Ã¢â€šÂ¬Ã…Â¡ÃƒÆ’Ã¢â‚¬Å¡Ãƒâ€šÃ‚Â¢ÃƒÆ’Ã†â€™Ãƒâ€ Ã¢â‚¬â„¢ÃƒÆ’Ã¢â‚¬Å¡Ãƒâ€šÃ‚Â¢ÃƒÆ’Ã†â€™Ãƒâ€šÃ‚Â¢ÃƒÆ’Ã‚Â¢ÃƒÂ¢Ã¢â€šÂ¬Ã…Â¡Ãƒâ€šÃ‚Â¬ÃƒÆ’Ã¢â‚¬Â¦Ãƒâ€šÃ‚Â¡ÃƒÆ’Ã†â€™ÃƒÂ¢Ã¢â€šÂ¬Ã…Â¡ÃƒÆ’Ã¢â‚¬Å¡Ãƒâ€šÃ‚Â¬ÃƒÆ’Ã†â€™Ãƒâ€ Ã¢â‚¬â„¢ÃƒÆ’Ã‚Â¢ÃƒÂ¢Ã¢â‚¬Å¡Ã‚Â¬Ãƒâ€šÃ‚Â¦ÃƒÆ’Ã†â€™ÃƒÂ¢Ã¢â€šÂ¬Ã…Â¡ÃƒÆ’Ã¢â‚¬Å¡Ãƒâ€šÃ‚Â¡ÃƒÆ’Ã†â€™Ãƒâ€ Ã¢â‚¬â„¢ÃƒÆ’Ã¢â‚¬Â ÃƒÂ¢Ã¢â€šÂ¬Ã¢â€žÂ¢ÃƒÆ’Ã†â€™ÃƒÂ¢Ã¢â€šÂ¬Ã‚Â ÃƒÆ’Ã‚Â¢ÃƒÂ¢Ã¢â‚¬Å¡Ã‚Â¬ÃƒÂ¢Ã¢â‚¬Å¾Ã‚Â¢ÃƒÆ’Ã†â€™Ãƒâ€ Ã¢â‚¬â„¢ÃƒÆ’Ã¢â‚¬Å¡Ãƒâ€šÃ‚Â¢ÃƒÆ’Ã†â€™Ãƒâ€šÃ‚Â¢ÃƒÆ’Ã‚Â¢ÃƒÂ¢Ã¢â‚¬Å¡Ã‚Â¬Ãƒâ€¦Ã‚Â¡ÃƒÆ’Ã¢â‚¬Å¡Ãƒâ€šÃ‚Â¬ÃƒÆ’Ã†â€™ÃƒÂ¢Ã¢â€šÂ¬Ã‚Â¦ÃƒÆ’Ã¢â‚¬Å¡Ãƒâ€šÃ‚Â¡ÃƒÆ’Ã†â€™Ãƒâ€ Ã¢â‚¬â„¢ÃƒÆ’Ã¢â‚¬Â ÃƒÂ¢Ã¢â€šÂ¬Ã¢â€žÂ¢ÃƒÆ’Ã†â€™Ãƒâ€šÃ‚Â¢ÃƒÆ’Ã‚Â¢ÃƒÂ¢Ã¢â€šÂ¬Ã…Â¡Ãƒâ€šÃ‚Â¬ÃƒÆ’Ã¢â‚¬Â¦Ãƒâ€šÃ‚Â¡ÃƒÆ’Ã†â€™Ãƒâ€ Ã¢â‚¬â„¢ÃƒÆ’Ã‚Â¢ÃƒÂ¢Ã¢â‚¬Å¡Ã‚Â¬Ãƒâ€¦Ã‚Â¡ÃƒÆ’Ã†â€™ÃƒÂ¢Ã¢â€šÂ¬Ã…Â¡ÃƒÆ’Ã¢â‚¬Å¡Ãƒâ€šÃ‚Â¼g</w:t>
       </w:r>
       <w:proofErr w:type="spellEnd"/>
       <w:r>
@@ -8887,7 +8887,7 @@
           <w:sz w:val="28"/>
           <w:szCs w:val="28"/>
         </w:rPr>
-        <w:t>The bar chart illustrates the changes in phosphate (POÃƒÆ’Ã†â€™Ãƒâ€ Ã¢â‚¬â„¢ÃƒÆ’Ã¢â‚¬Â ÃƒÂ¢Ã¢â€šÂ¬Ã¢â€žÂ¢ÃƒÆ’Ã†â€™ÃƒÂ¢Ã¢â€šÂ¬Ã‚Â ÃƒÆ’Ã‚Â¢ÃƒÂ¢Ã¢â‚¬Å¡Ã‚Â¬ÃƒÂ¢Ã¢â‚¬Å¾Ã‚Â¢ÃƒÆ’Ã†â€™Ãƒâ€ Ã¢â‚¬â„¢ÃƒÆ’Ã‚Â¢ÃƒÂ¢Ã¢â‚¬Å¡Ã‚Â¬Ãƒâ€¦Ã‚Â¡ÃƒÆ’Ã†â€™ÃƒÂ¢Ã¢â€šÂ¬Ã…Â¡ÃƒÆ’Ã¢â‚¬Å¡Ãƒâ€šÃ‚Â¢ÃƒÆ’Ã†â€™Ãƒâ€ Ã¢â‚¬â„¢ÃƒÆ’Ã¢â‚¬Â ÃƒÂ¢Ã¢â€šÂ¬Ã¢â€žÂ¢ÃƒÆ’Ã†â€™ÃƒÂ¢Ã¢â€šÂ¬Ã…Â¡ÃƒÆ’Ã¢â‚¬Å¡Ãƒâ€šÃ‚Â¢ÃƒÆ’Ã†â€™Ãƒâ€ Ã¢â‚¬â„¢ÃƒÆ’Ã¢â‚¬Å¡Ãƒâ€šÃ‚Â¢ÃƒÆ’Ã†â€™Ãƒâ€šÃ‚Â¢ÃƒÆ’Ã‚Â¢ÃƒÂ¢Ã¢â€šÂ¬Ã…Â¡Ãƒâ€šÃ‚Â¬ÃƒÆ’Ã¢â‚¬Â¦Ãƒâ€šÃ‚Â¡ÃƒÆ’Ã†â€™ÃƒÂ¢Ã¢â€šÂ¬Ã…Â¡ÃƒÆ’Ã¢â‚¬Å¡Ãƒâ€šÃ‚Â¬ÃƒÆ’Ã†â€™Ãƒâ€ Ã¢â‚¬â„¢ÃƒÆ’Ã‚Â¢ÃƒÂ¢Ã¢â‚¬Å¡Ã‚Â¬Ãƒâ€šÃ‚Â¦ÃƒÆ’Ã†â€™ÃƒÂ¢Ã¢â€šÂ¬Ã…Â¡ÃƒÆ’Ã¢â‚¬Å¡Ãƒâ€šÃ‚Â¡ÃƒÆ’Ã†â€™Ãƒâ€ Ã¢â‚¬â„¢ÃƒÆ’Ã¢â‚¬Â ÃƒÂ¢Ã¢â€šÂ¬Ã¢â€žÂ¢ÃƒÆ’Ã†â€™ÃƒÂ¢Ã¢â€šÂ¬Ã…Â¡ÃƒÆ’Ã¢â‚¬Å¡Ãƒâ€šÃ‚Â¢ÃƒÆ’Ã†â€™Ãƒâ€ Ã¢â‚¬â„¢ÃƒÆ’Ã¢â‚¬Å¡Ãƒâ€šÃ‚Â¢ÃƒÆ’Ã†â€™Ãƒâ€šÃ‚Â¢ÃƒÆ’Ã‚Â¢ÃƒÂ¢Ã¢â€šÂ¬Ã…Â¡Ãƒâ€šÃ‚Â¬ÃƒÆ’Ã¢â‚¬Â¦Ãƒâ€šÃ‚Â¡ÃƒÆ’Ã†â€™ÃƒÂ¢Ã¢â€šÂ¬Ã…Â¡ÃƒÆ’Ã¢â‚¬Å¡Ãƒâ€šÃ‚Â¬ÃƒÆ’Ã†â€™Ãƒâ€ Ã¢â‚¬â„¢ÃƒÆ’Ã‚Â¢ÃƒÂ¢Ã¢â‚¬Å¡Ã‚Â¬Ãƒâ€šÃ‚Â¦ÃƒÆ’Ã†â€™ÃƒÂ¢Ã¢â€šÂ¬Ã…Â¡ÃƒÆ’Ã¢â‚¬Å¡Ãƒâ€šÃ‚Â¾ÃƒÆ’Ã†â€™Ãƒâ€ Ã¢â‚¬â„¢ÃƒÆ’Ã¢â‚¬Â ÃƒÂ¢Ã¢â€šÂ¬Ã¢â€žÂ¢ÃƒÆ’Ã†â€™ÃƒÂ¢Ã¢â€šÂ¬Ã‚Â ÃƒÆ’Ã‚Â¢ÃƒÂ¢Ã¢â‚¬Å¡Ã‚Â¬ÃƒÂ¢Ã¢â‚¬Å¾Ã‚Â¢ÃƒÆ’Ã†â€™Ãƒâ€ Ã¢â‚¬â„¢ÃƒÆ’Ã¢â‚¬Å¡Ãƒâ€šÃ‚Â¢ÃƒÆ’Ã†â€™Ãƒâ€šÃ‚Â¢ÃƒÆ’Ã‚Â¢ÃƒÂ¢Ã¢â‚¬Å¡Ã‚Â¬Ãƒâ€¦Ã‚Â¡ÃƒÆ’Ã¢â‚¬Å¡Ãƒâ€šÃ‚Â¬ÃƒÆ’Ã†â€™ÃƒÂ¢Ã¢â€šÂ¬Ã‚Â¦ÃƒÆ’Ã¢â‚¬Å¡Ãƒâ€šÃ‚Â¡ÃƒÆ’Ã†â€™Ãƒâ€ Ã¢â‚¬â„¢ÃƒÆ’Ã¢â‚¬Â ÃƒÂ¢Ã¢â€šÂ¬Ã¢â€žÂ¢ÃƒÆ’Ã†â€™Ãƒâ€šÃ‚Â¢ÃƒÆ’Ã‚Â¢ÃƒÂ¢Ã¢â€šÂ¬Ã…Â¡Ãƒâ€šÃ‚Â¬ÃƒÆ’Ã¢â‚¬Â¦Ãƒâ€šÃ‚Â¡ÃƒÆ’Ã†â€™Ãƒâ€ Ã¢â‚¬â„¢ÃƒÆ’Ã‚Â¢ÃƒÂ¢Ã¢â‚¬Å¡Ã‚Â¬Ãƒâ€¦Ã‚Â¡ÃƒÆ’Ã†â€™ÃƒÂ¢Ã¢â€šÂ¬Ã…Â¡ÃƒÆ’Ã¢â‚¬Å¡Ãƒâ€šÃ‚Â³ÃƒÆ’Ã†â€™Ãƒâ€ Ã¢â‚¬â„¢ÃƒÆ’Ã¢â‚¬Â ÃƒÂ¢Ã¢â€šÂ¬Ã¢â€žÂ¢ÃƒÆ’Ã†â€™ÃƒÂ¢Ã¢â€šÂ¬Ã‚Â ÃƒÆ’Ã‚Â¢ÃƒÂ¢Ã¢â‚¬Å¡Ã‚Â¬ÃƒÂ¢Ã¢â‚¬Å¾Ã‚Â¢ÃƒÆ’Ã†â€™Ãƒâ€ Ã¢â‚¬â„¢ÃƒÆ’Ã‚Â¢ÃƒÂ¢Ã¢â‚¬Å¡Ã‚Â¬Ãƒâ€¦Ã‚Â¡ÃƒÆ’Ã†â€™ÃƒÂ¢Ã¢â€šÂ¬Ã…Â¡ÃƒÆ’Ã¢â‚¬Å¡Ãƒâ€šÃ‚Â¢ÃƒÆ’Ã†â€™Ãƒâ€ Ã¢â‚¬â„¢ÃƒÆ’Ã¢â‚¬Â ÃƒÂ¢Ã¢â€šÂ¬Ã¢â€žÂ¢ÃƒÆ’Ã†â€™Ãƒâ€šÃ‚Â¢ÃƒÆ’Ã‚Â¢ÃƒÂ¢Ã¢â€šÂ¬Ã…Â¡Ãƒâ€šÃ‚Â¬ÃƒÆ’Ã¢â‚¬Â¦Ãƒâ€šÃ‚Â¡ÃƒÆ’Ã†â€™Ãƒâ€ Ã¢â‚¬â„¢ÃƒÆ’Ã‚Â¢ÃƒÂ¢Ã¢â‚¬Å¡Ã‚Â¬Ãƒâ€¦Ã‚Â¡ÃƒÆ’Ã†â€™ÃƒÂ¢Ã¢â€šÂ¬Ã…Â¡ÃƒÆ’Ã¢â‚¬Å¡Ãƒâ€šÃ‚ÂÃƒÆ’Ã†â€™Ãƒâ€ Ã¢â‚¬â„¢ÃƒÆ’Ã¢â‚¬Â ÃƒÂ¢Ã¢â€šÂ¬Ã¢â€žÂ¢ÃƒÆ’Ã†â€™Ãƒâ€šÃ‚Â¢ÃƒÆ’Ã‚Â¢ÃƒÂ¢Ã¢â€šÂ¬Ã…Â¡Ãƒâ€šÃ‚Â¬ÃƒÆ’Ã¢â‚¬Â¦Ãƒâ€šÃ‚Â¡ÃƒÆ’Ã†â€™Ãƒâ€ Ã¢â‚¬â„¢ÃƒÆ’Ã‚Â¢ÃƒÂ¢Ã¢â‚¬Å¡Ã‚Â¬Ãƒâ€¦Ã‚Â¡ÃƒÆ’Ã†â€™ÃƒÂ¢Ã¢â€šÂ¬Ã…Â¡ÃƒÆ’Ã¢â‚¬Å¡Ãƒâ€šÃ‚Â») concentration (</w:t>
+        <w:t>The bar chart illustrates the changes in phosphate (POÃƒÆ’Ã†â€™Ãƒâ€ Ã¢â‚¬â„¢ÃƒÆ’Ã¢â‚¬Â ÃƒÂ¢Ã¢â€šÂ¬Ã¢â€žÂ¢ÃƒÆ’Ã†â€™ÃƒÂ¢Ã¢â€šÂ¬Ã‚Â ÃƒÆ’Ã‚Â¢ÃƒÂ¢Ã¢â‚¬Å¡Ã‚Â¬ÃƒÂ¢Ã¢â‚¬Å¾Ã‚Â¢ÃƒÆ’Ã†â€™Ãƒâ€ Ã¢â‚¬â„¢ÃƒÆ’Ã‚Â¢ÃƒÂ¢Ã¢â‚¬Å¡Ã‚Â¬Ãƒâ€šÃ‚Â ÃƒÆ’Ã†â€™Ãƒâ€šÃ‚Â¢ÃƒÆ’Ã‚Â¢ÃƒÂ¢Ã¢â€šÂ¬Ã…Â¡Ãƒâ€šÃ‚Â¬ÃƒÆ’Ã‚Â¢ÃƒÂ¢Ã¢â€šÂ¬Ã…Â¾Ãƒâ€šÃ‚Â¢ÃƒÆ’Ã†â€™Ãƒâ€ Ã¢â‚¬â„¢ÃƒÆ’Ã¢â‚¬Â ÃƒÂ¢Ã¢â€šÂ¬Ã¢â€žÂ¢ÃƒÆ’Ã†â€™Ãƒâ€šÃ‚Â¢ÃƒÆ’Ã‚Â¢ÃƒÂ¢Ã¢â€šÂ¬Ã…Â¡Ãƒâ€šÃ‚Â¬ÃƒÆ’Ã¢â‚¬Å¡Ãƒâ€šÃ‚Â ÃƒÆ’Ã†â€™Ãƒâ€ Ã¢â‚¬â„¢ÃƒÆ’Ã¢â‚¬Å¡Ãƒâ€šÃ‚Â¢ÃƒÆ’Ã†â€™Ãƒâ€šÃ‚Â¢ÃƒÆ’Ã‚Â¢ÃƒÂ¢Ã¢â‚¬Å¡Ã‚Â¬Ãƒâ€¦Ã‚Â¡ÃƒÆ’Ã¢â‚¬Å¡Ãƒâ€šÃ‚Â¬ÃƒÆ’Ã†â€™Ãƒâ€šÃ‚Â¢ÃƒÆ’Ã‚Â¢ÃƒÂ¢Ã¢â‚¬Å¡Ã‚Â¬Ãƒâ€¦Ã‚Â¾ÃƒÆ’Ã¢â‚¬Å¡Ãƒâ€šÃ‚Â¢ÃƒÆ’Ã†â€™Ãƒâ€ Ã¢â‚¬â„¢ÃƒÆ’Ã¢â‚¬Â ÃƒÂ¢Ã¢â€šÂ¬Ã¢â€žÂ¢ÃƒÆ’Ã†â€™ÃƒÂ¢Ã¢â€šÂ¬Ã‚Â ÃƒÆ’Ã‚Â¢ÃƒÂ¢Ã¢â‚¬Å¡Ã‚Â¬ÃƒÂ¢Ã¢â‚¬Å¾Ã‚Â¢ÃƒÆ’Ã†â€™Ãƒâ€ Ã¢â‚¬â„¢ÃƒÆ’Ã¢â‚¬Å¡Ãƒâ€šÃ‚Â¢ÃƒÆ’Ã†â€™Ãƒâ€šÃ‚Â¢ÃƒÆ’Ã‚Â¢ÃƒÂ¢Ã¢â‚¬Å¡Ã‚Â¬Ãƒâ€¦Ã‚Â¡ÃƒÆ’Ã¢â‚¬Å¡Ãƒâ€šÃ‚Â¬ÃƒÆ’Ã†â€™ÃƒÂ¢Ã¢â€šÂ¬Ã‚Â¦ÃƒÆ’Ã¢â‚¬Å¡Ãƒâ€šÃ‚Â¡ÃƒÆ’Ã†â€™Ãƒâ€ Ã¢â‚¬â„¢ÃƒÆ’Ã¢â‚¬Â ÃƒÂ¢Ã¢â€šÂ¬Ã¢â€žÂ¢ÃƒÆ’Ã†â€™Ãƒâ€šÃ‚Â¢ÃƒÆ’Ã‚Â¢ÃƒÂ¢Ã¢â€šÂ¬Ã…Â¡Ãƒâ€šÃ‚Â¬ÃƒÆ’Ã¢â‚¬Â¦Ãƒâ€šÃ‚Â¡ÃƒÆ’Ã†â€™Ãƒâ€ Ã¢â‚¬â„¢ÃƒÆ’Ã‚Â¢ÃƒÂ¢Ã¢â‚¬Å¡Ã‚Â¬Ãƒâ€¦Ã‚Â¡ÃƒÆ’Ã†â€™ÃƒÂ¢Ã¢â€šÂ¬Ã…Â¡ÃƒÆ’Ã¢â‚¬Å¡Ãƒâ€šÃ‚Â¢ÃƒÆ’Ã†â€™Ãƒâ€ Ã¢â‚¬â„¢ÃƒÆ’Ã¢â‚¬Â ÃƒÂ¢Ã¢â€šÂ¬Ã¢â€žÂ¢ÃƒÆ’Ã†â€™ÃƒÂ¢Ã¢â€šÂ¬Ã‚Â ÃƒÆ’Ã‚Â¢ÃƒÂ¢Ã¢â‚¬Å¡Ã‚Â¬ÃƒÂ¢Ã¢â‚¬Å¾Ã‚Â¢ÃƒÆ’Ã†â€™Ãƒâ€ Ã¢â‚¬â„¢ÃƒÆ’Ã‚Â¢ÃƒÂ¢Ã¢â‚¬Å¡Ã‚Â¬Ãƒâ€šÃ‚Â ÃƒÆ’Ã†â€™Ãƒâ€šÃ‚Â¢ÃƒÆ’Ã‚Â¢ÃƒÂ¢Ã¢â€šÂ¬Ã…Â¡Ãƒâ€šÃ‚Â¬ÃƒÆ’Ã‚Â¢ÃƒÂ¢Ã¢â€šÂ¬Ã…Â¾Ãƒâ€šÃ‚Â¢ÃƒÆ’Ã†â€™Ãƒâ€ Ã¢â‚¬â„¢ÃƒÆ’Ã¢â‚¬Â ÃƒÂ¢Ã¢â€šÂ¬Ã¢â€žÂ¢ÃƒÆ’Ã†â€™Ãƒâ€šÃ‚Â¢ÃƒÆ’Ã‚Â¢ÃƒÂ¢Ã¢â€šÂ¬Ã…Â¡Ãƒâ€šÃ‚Â¬ÃƒÆ’Ã¢â‚¬Â¦Ãƒâ€šÃ‚Â¡ÃƒÆ’Ã†â€™Ãƒâ€ Ã¢â‚¬â„¢ÃƒÆ’Ã‚Â¢ÃƒÂ¢Ã¢â‚¬Å¡Ã‚Â¬Ãƒâ€¦Ã‚Â¡ÃƒÆ’Ã†â€™ÃƒÂ¢Ã¢â€šÂ¬Ã…Â¡ÃƒÆ’Ã¢â‚¬Å¡Ãƒâ€šÃ‚Â¢ÃƒÆ’Ã†â€™Ãƒâ€ Ã¢â‚¬â„¢ÃƒÆ’Ã¢â‚¬Â ÃƒÂ¢Ã¢â€šÂ¬Ã¢â€žÂ¢ÃƒÆ’Ã†â€™ÃƒÂ¢Ã¢â€šÂ¬Ã‚Â ÃƒÆ’Ã‚Â¢ÃƒÂ¢Ã¢â‚¬Å¡Ã‚Â¬ÃƒÂ¢Ã¢â‚¬Å¾Ã‚Â¢ÃƒÆ’Ã†â€™Ãƒâ€ Ã¢â‚¬â„¢ÃƒÆ’Ã‚Â¢ÃƒÂ¢Ã¢â‚¬Å¡Ã‚Â¬Ãƒâ€¦Ã‚Â¡ÃƒÆ’Ã†â€™ÃƒÂ¢Ã¢â€šÂ¬Ã…Â¡ÃƒÆ’Ã¢â‚¬Å¡Ãƒâ€šÃ‚Â¢ÃƒÆ’Ã†â€™Ãƒâ€ Ã¢â‚¬â„¢ÃƒÆ’Ã¢â‚¬Â ÃƒÂ¢Ã¢â€šÂ¬Ã¢â€žÂ¢ÃƒÆ’Ã†â€™ÃƒÂ¢Ã¢â€šÂ¬Ã…Â¡ÃƒÆ’Ã¢â‚¬Å¡Ãƒâ€šÃ‚Â¢ÃƒÆ’Ã†â€™Ãƒâ€ Ã¢â‚¬â„¢ÃƒÆ’Ã¢â‚¬Å¡Ãƒâ€šÃ‚Â¢ÃƒÆ’Ã†â€™Ãƒâ€šÃ‚Â¢ÃƒÆ’Ã‚Â¢ÃƒÂ¢Ã¢â€šÂ¬Ã…Â¡Ãƒâ€šÃ‚Â¬ÃƒÆ’Ã¢â‚¬Â¦Ãƒâ€šÃ‚Â¡ÃƒÆ’Ã†â€™ÃƒÂ¢Ã¢â€šÂ¬Ã…Â¡ÃƒÆ’Ã¢â‚¬Å¡Ãƒâ€šÃ‚Â¬ÃƒÆ’Ã†â€™Ãƒâ€ Ã¢â‚¬â„¢ÃƒÆ’Ã‚Â¢ÃƒÂ¢Ã¢â‚¬Å¡Ã‚Â¬Ãƒâ€šÃ‚Â¦ÃƒÆ’Ã†â€™ÃƒÂ¢Ã¢â€šÂ¬Ã…Â¡ÃƒÆ’Ã¢â‚¬Å¡Ãƒâ€šÃ‚Â¡ÃƒÆ’Ã†â€™Ãƒâ€ Ã¢â‚¬â„¢ÃƒÆ’Ã¢â‚¬Â ÃƒÂ¢Ã¢â€šÂ¬Ã¢â€žÂ¢ÃƒÆ’Ã†â€™Ãƒâ€šÃ‚Â¢ÃƒÆ’Ã‚Â¢ÃƒÂ¢Ã¢â€šÂ¬Ã…Â¡Ãƒâ€šÃ‚Â¬ÃƒÆ’Ã¢â‚¬Â¦Ãƒâ€šÃ‚Â¡ÃƒÆ’Ã†â€™Ãƒâ€ Ã¢â‚¬â„¢ÃƒÆ’Ã‚Â¢ÃƒÂ¢Ã¢â‚¬Å¡Ã‚Â¬Ãƒâ€¦Ã‚Â¡ÃƒÆ’Ã†â€™ÃƒÂ¢Ã¢â€šÂ¬Ã…Â¡ÃƒÆ’Ã¢â‚¬Å¡Ãƒâ€šÃ‚Â¬ÃƒÆ’Ã†â€™Ãƒâ€ Ã¢â‚¬â„¢ÃƒÆ’Ã¢â‚¬Â ÃƒÂ¢Ã¢â€šÂ¬Ã¢â€žÂ¢ÃƒÆ’Ã†â€™ÃƒÂ¢Ã¢â€šÂ¬Ã‚Â ÃƒÆ’Ã‚Â¢ÃƒÂ¢Ã¢â‚¬Å¡Ã‚Â¬ÃƒÂ¢Ã¢â‚¬Å¾Ã‚Â¢ÃƒÆ’Ã†â€™Ãƒâ€ Ã¢â‚¬â„¢ÃƒÆ’Ã¢â‚¬Å¡Ãƒâ€šÃ‚Â¢ÃƒÆ’Ã†â€™Ãƒâ€šÃ‚Â¢ÃƒÆ’Ã‚Â¢ÃƒÂ¢Ã¢â‚¬Å¡Ã‚Â¬Ãƒâ€¦Ã‚Â¡ÃƒÆ’Ã¢â‚¬Å¡Ãƒâ€šÃ‚Â¬ÃƒÆ’Ã†â€™ÃƒÂ¢Ã¢â€šÂ¬Ã…Â¡ÃƒÆ’Ã¢â‚¬Å¡Ãƒâ€šÃ‚Â¦ÃƒÆ’Ã†â€™Ãƒâ€ Ã¢â‚¬â„¢ÃƒÆ’Ã¢â‚¬Â ÃƒÂ¢Ã¢â€šÂ¬Ã¢â€žÂ¢ÃƒÆ’Ã†â€™Ãƒâ€šÃ‚Â¢ÃƒÆ’Ã‚Â¢ÃƒÂ¢Ã¢â€šÂ¬Ã…Â¡Ãƒâ€šÃ‚Â¬ÃƒÆ’Ã¢â‚¬Â¦Ãƒâ€šÃ‚Â¡ÃƒÆ’Ã†â€™Ãƒâ€ Ã¢â‚¬â„¢ÃƒÆ’Ã‚Â¢ÃƒÂ¢Ã¢â‚¬Å¡Ã‚Â¬Ãƒâ€¦Ã‚Â¡ÃƒÆ’Ã†â€™ÃƒÂ¢Ã¢â€šÂ¬Ã…Â¡ÃƒÆ’Ã¢â‚¬Å¡Ãƒâ€šÃ‚Â¡ÃƒÆ’Ã†â€™Ãƒâ€ Ã¢â‚¬â„¢ÃƒÆ’Ã¢â‚¬Â ÃƒÂ¢Ã¢â€šÂ¬Ã¢â€žÂ¢ÃƒÆ’Ã†â€™ÃƒÂ¢Ã¢â€šÂ¬Ã‚Â ÃƒÆ’Ã‚Â¢ÃƒÂ¢Ã¢â‚¬Å¡Ã‚Â¬ÃƒÂ¢Ã¢â‚¬Å¾Ã‚Â¢ÃƒÆ’Ã†â€™Ãƒâ€ Ã¢â‚¬â„¢ÃƒÆ’Ã‚Â¢ÃƒÂ¢Ã¢â‚¬Å¡Ã‚Â¬Ãƒâ€šÃ‚Â ÃƒÆ’Ã†â€™Ãƒâ€šÃ‚Â¢ÃƒÆ’Ã‚Â¢ÃƒÂ¢Ã¢â€šÂ¬Ã…Â¡Ãƒâ€šÃ‚Â¬ÃƒÆ’Ã‚Â¢ÃƒÂ¢Ã¢â€šÂ¬Ã…Â¾Ãƒâ€šÃ‚Â¢ÃƒÆ’Ã†â€™Ãƒâ€ Ã¢â‚¬â„¢ÃƒÆ’Ã¢â‚¬Â ÃƒÂ¢Ã¢â€šÂ¬Ã¢â€žÂ¢ÃƒÆ’Ã†â€™Ãƒâ€šÃ‚Â¢ÃƒÆ’Ã‚Â¢ÃƒÂ¢Ã¢â€šÂ¬Ã…Â¡Ãƒâ€šÃ‚Â¬ÃƒÆ’Ã¢â‚¬Â¦Ãƒâ€šÃ‚Â¡ÃƒÆ’Ã†â€™Ãƒâ€ Ã¢â‚¬â„¢ÃƒÆ’Ã‚Â¢ÃƒÂ¢Ã¢â‚¬Å¡Ã‚Â¬Ãƒâ€¦Ã‚Â¡ÃƒÆ’Ã†â€™ÃƒÂ¢Ã¢â€šÂ¬Ã…Â¡ÃƒÆ’Ã¢â‚¬Å¡Ãƒâ€šÃ‚Â¢ÃƒÆ’Ã†â€™Ãƒâ€ Ã¢â‚¬â„¢ÃƒÆ’Ã¢â‚¬Â ÃƒÂ¢Ã¢â€šÂ¬Ã¢â€žÂ¢ÃƒÆ’Ã†â€™ÃƒÂ¢Ã¢â€šÂ¬Ã‚Â ÃƒÆ’Ã‚Â¢ÃƒÂ¢Ã¢â‚¬Å¡Ã‚Â¬ÃƒÂ¢Ã¢â‚¬Å¾Ã‚Â¢ÃƒÆ’Ã†â€™Ãƒâ€ Ã¢â‚¬â„¢ÃƒÆ’Ã‚Â¢ÃƒÂ¢Ã¢â‚¬Å¡Ã‚Â¬Ãƒâ€¦Ã‚Â¡ÃƒÆ’Ã†â€™ÃƒÂ¢Ã¢â€šÂ¬Ã…Â¡ÃƒÆ’Ã¢â‚¬Å¡Ãƒâ€šÃ‚Â¢ÃƒÆ’Ã†â€™Ãƒâ€ Ã¢â‚¬â„¢ÃƒÆ’Ã¢â‚¬Â ÃƒÂ¢Ã¢â€šÂ¬Ã¢â€žÂ¢ÃƒÆ’Ã†â€™ÃƒÂ¢Ã¢â€šÂ¬Ã…Â¡ÃƒÆ’Ã¢â‚¬Å¡Ãƒâ€šÃ‚Â¢ÃƒÆ’Ã†â€™Ãƒâ€ Ã¢â‚¬â„¢ÃƒÆ’Ã¢â‚¬Å¡Ãƒâ€šÃ‚Â¢ÃƒÆ’Ã†â€™Ãƒâ€šÃ‚Â¢ÃƒÆ’Ã‚Â¢ÃƒÂ¢Ã¢â€šÂ¬Ã…Â¡Ãƒâ€šÃ‚Â¬ÃƒÆ’Ã¢â‚¬Â¦Ãƒâ€šÃ‚Â¡ÃƒÆ’Ã†â€™ÃƒÂ¢Ã¢â€šÂ¬Ã…Â¡ÃƒÆ’Ã¢â‚¬Å¡Ãƒâ€šÃ‚Â¬ÃƒÆ’Ã†â€™Ãƒâ€ Ã¢â‚¬â„¢ÃƒÆ’Ã‚Â¢ÃƒÂ¢Ã¢â‚¬Å¡Ã‚Â¬Ãƒâ€šÃ‚Â¦ÃƒÆ’Ã†â€™ÃƒÂ¢Ã¢â€šÂ¬Ã…Â¡ÃƒÆ’Ã¢â‚¬Å¡Ãƒâ€šÃ‚Â¡ÃƒÆ’Ã†â€™Ãƒâ€ Ã¢â‚¬â„¢ÃƒÆ’Ã¢â‚¬Â ÃƒÂ¢Ã¢â€šÂ¬Ã¢â€žÂ¢ÃƒÆ’Ã†â€™Ãƒâ€šÃ‚Â¢ÃƒÆ’Ã‚Â¢ÃƒÂ¢Ã¢â€šÂ¬Ã…Â¡Ãƒâ€šÃ‚Â¬ÃƒÆ’Ã¢â‚¬Â¦Ãƒâ€šÃ‚Â¡ÃƒÆ’Ã†â€™Ãƒâ€ Ã¢â‚¬â„¢ÃƒÆ’Ã‚Â¢ÃƒÂ¢Ã¢â‚¬Å¡Ã‚Â¬Ãƒâ€¦Ã‚Â¡ÃƒÆ’Ã†â€™ÃƒÂ¢Ã¢â€šÂ¬Ã…Â¡ÃƒÆ’Ã¢â‚¬Å¡Ãƒâ€šÃ‚Â¬ÃƒÆ’Ã†â€™Ãƒâ€ Ã¢â‚¬â„¢ÃƒÆ’Ã¢â‚¬Â ÃƒÂ¢Ã¢â€šÂ¬Ã¢â€žÂ¢ÃƒÆ’Ã†â€™ÃƒÂ¢Ã¢â€šÂ¬Ã‚Â ÃƒÆ’Ã‚Â¢ÃƒÂ¢Ã¢â‚¬Å¡Ã‚Â¬ÃƒÂ¢Ã¢â‚¬Å¾Ã‚Â¢ÃƒÆ’Ã†â€™Ãƒâ€ Ã¢â‚¬â„¢ÃƒÆ’Ã¢â‚¬Å¡Ãƒâ€šÃ‚Â¢ÃƒÆ’Ã†â€™Ãƒâ€šÃ‚Â¢ÃƒÆ’Ã‚Â¢ÃƒÂ¢Ã¢â‚¬Å¡Ã‚Â¬Ãƒâ€¦Ã‚Â¡ÃƒÆ’Ã¢â‚¬Å¡Ãƒâ€šÃ‚Â¬ÃƒÆ’Ã†â€™ÃƒÂ¢Ã¢â€šÂ¬Ã…Â¡ÃƒÆ’Ã¢â‚¬Å¡Ãƒâ€šÃ‚Â¦ÃƒÆ’Ã†â€™Ãƒâ€ Ã¢â‚¬â„¢ÃƒÆ’Ã¢â‚¬Â ÃƒÂ¢Ã¢â€šÂ¬Ã¢â€žÂ¢ÃƒÆ’Ã†â€™Ãƒâ€šÃ‚Â¢ÃƒÆ’Ã‚Â¢ÃƒÂ¢Ã¢â€šÂ¬Ã…Â¡Ãƒâ€šÃ‚Â¬ÃƒÆ’Ã¢â‚¬Â¦Ãƒâ€šÃ‚Â¡ÃƒÆ’Ã†â€™Ãƒâ€ Ã¢â‚¬â„¢ÃƒÆ’Ã‚Â¢ÃƒÂ¢Ã¢â‚¬Å¡Ã‚Â¬Ãƒâ€¦Ã‚Â¡ÃƒÆ’Ã†â€™ÃƒÂ¢Ã¢â€šÂ¬Ã…Â¡ÃƒÆ’Ã¢â‚¬Å¡Ãƒâ€šÃ‚Â¾ÃƒÆ’Ã†â€™Ãƒâ€ Ã¢â‚¬â„¢ÃƒÆ’Ã¢â‚¬Â ÃƒÂ¢Ã¢â€šÂ¬Ã¢â€žÂ¢ÃƒÆ’Ã†â€™ÃƒÂ¢Ã¢â€šÂ¬Ã‚Â ÃƒÆ’Ã‚Â¢ÃƒÂ¢Ã¢â‚¬Å¡Ã‚Â¬ÃƒÂ¢Ã¢â‚¬Å¾Ã‚Â¢ÃƒÆ’Ã†â€™Ãƒâ€ Ã¢â‚¬â„¢ÃƒÆ’Ã‚Â¢ÃƒÂ¢Ã¢â‚¬Å¡Ã‚Â¬Ãƒâ€šÃ‚Â ÃƒÆ’Ã†â€™Ãƒâ€šÃ‚Â¢ÃƒÆ’Ã‚Â¢ÃƒÂ¢Ã¢â€šÂ¬Ã…Â¡Ãƒâ€šÃ‚Â¬ÃƒÆ’Ã‚Â¢ÃƒÂ¢Ã¢â€šÂ¬Ã…Â¾Ãƒâ€šÃ‚Â¢ÃƒÆ’Ã†â€™Ãƒâ€ Ã¢â‚¬â„¢ÃƒÆ’Ã¢â‚¬Â ÃƒÂ¢Ã¢â€šÂ¬Ã¢â€žÂ¢ÃƒÆ’Ã†â€™Ãƒâ€šÃ‚Â¢ÃƒÆ’Ã‚Â¢ÃƒÂ¢Ã¢â€šÂ¬Ã…Â¡Ãƒâ€šÃ‚Â¬ÃƒÆ’Ã¢â‚¬Å¡Ãƒâ€šÃ‚Â ÃƒÆ’Ã†â€™Ãƒâ€ Ã¢â‚¬â„¢ÃƒÆ’Ã¢â‚¬Å¡Ãƒâ€šÃ‚Â¢ÃƒÆ’Ã†â€™Ãƒâ€šÃ‚Â¢ÃƒÆ’Ã‚Â¢ÃƒÂ¢Ã¢â‚¬Å¡Ã‚Â¬Ãƒâ€¦Ã‚Â¡ÃƒÆ’Ã¢â‚¬Å¡Ãƒâ€šÃ‚Â¬ÃƒÆ’Ã†â€™Ãƒâ€šÃ‚Â¢ÃƒÆ’Ã‚Â¢ÃƒÂ¢Ã¢â‚¬Å¡Ã‚Â¬Ãƒâ€¦Ã‚Â¾ÃƒÆ’Ã¢â‚¬Å¡Ãƒâ€šÃ‚Â¢ÃƒÆ’Ã†â€™Ãƒâ€ Ã¢â‚¬â„¢ÃƒÆ’Ã¢â‚¬Â ÃƒÂ¢Ã¢â€šÂ¬Ã¢â€žÂ¢ÃƒÆ’Ã†â€™ÃƒÂ¢Ã¢â€šÂ¬Ã‚Â ÃƒÆ’Ã‚Â¢ÃƒÂ¢Ã¢â‚¬Å¡Ã‚Â¬ÃƒÂ¢Ã¢â‚¬Å¾Ã‚Â¢ÃƒÆ’Ã†â€™Ãƒâ€ Ã¢â‚¬â„¢ÃƒÆ’Ã‚Â¢ÃƒÂ¢Ã¢â‚¬Å¡Ã‚Â¬Ãƒâ€¦Ã‚Â¡ÃƒÆ’Ã†â€™ÃƒÂ¢Ã¢â€šÂ¬Ã…Â¡ÃƒÆ’Ã¢â‚¬Å¡Ãƒâ€šÃ‚Â¢ÃƒÆ’Ã†â€™Ãƒâ€ Ã¢â‚¬â„¢ÃƒÆ’Ã¢â‚¬Â ÃƒÂ¢Ã¢â€šÂ¬Ã¢â€žÂ¢ÃƒÆ’Ã†â€™ÃƒÂ¢Ã¢â€šÂ¬Ã…Â¡ÃƒÆ’Ã¢â‚¬Å¡Ãƒâ€šÃ‚Â¢ÃƒÆ’Ã†â€™Ãƒâ€ Ã¢â‚¬â„¢ÃƒÆ’Ã¢â‚¬Å¡Ãƒâ€šÃ‚Â¢ÃƒÆ’Ã†â€™Ãƒâ€šÃ‚Â¢ÃƒÆ’Ã‚Â¢ÃƒÂ¢Ã¢â‚¬Å¡Ã‚Â¬Ãƒâ€¦Ã‚Â¡ÃƒÆ’Ã¢â‚¬Å¡Ãƒâ€šÃ‚Â¬ÃƒÆ’Ã†â€™ÃƒÂ¢Ã¢â€šÂ¬Ã‚Â¦ÃƒÆ’Ã¢â‚¬Å¡Ãƒâ€šÃ‚Â¡ÃƒÆ’Ã†â€™Ãƒâ€ Ã¢â‚¬â„¢ÃƒÆ’Ã‚Â¢ÃƒÂ¢Ã¢â‚¬Å¡Ã‚Â¬Ãƒâ€¦Ã‚Â¡ÃƒÆ’Ã†â€™ÃƒÂ¢Ã¢â€šÂ¬Ã…Â¡ÃƒÆ’Ã¢â‚¬Å¡Ãƒâ€šÃ‚Â¬ÃƒÆ’Ã†â€™Ãƒâ€ Ã¢â‚¬â„¢ÃƒÆ’Ã¢â‚¬Â ÃƒÂ¢Ã¢â€šÂ¬Ã¢â€žÂ¢ÃƒÆ’Ã†â€™Ãƒâ€šÃ‚Â¢ÃƒÆ’Ã‚Â¢ÃƒÂ¢Ã¢â€šÂ¬Ã…Â¡Ãƒâ€šÃ‚Â¬ÃƒÆ’Ã¢â‚¬Å¡Ãƒâ€šÃ‚Â¦ÃƒÆ’Ã†â€™Ãƒâ€ Ã¢â‚¬â„¢ÃƒÆ’Ã‚Â¢ÃƒÂ¢Ã¢â‚¬Å¡Ã‚Â¬Ãƒâ€¦Ã‚Â¡ÃƒÆ’Ã†â€™ÃƒÂ¢Ã¢â€šÂ¬Ã…Â¡ÃƒÆ’Ã¢â‚¬Å¡Ãƒâ€šÃ‚Â¡ÃƒÆ’Ã†â€™Ãƒâ€ Ã¢â‚¬â„¢ÃƒÆ’Ã¢â‚¬Â ÃƒÂ¢Ã¢â€šÂ¬Ã¢â€žÂ¢ÃƒÆ’Ã†â€™ÃƒÂ¢Ã¢â€šÂ¬Ã‚Â ÃƒÆ’Ã‚Â¢ÃƒÂ¢Ã¢â‚¬Å¡Ã‚Â¬ÃƒÂ¢Ã¢â‚¬Å¾Ã‚Â¢ÃƒÆ’Ã†â€™Ãƒâ€ Ã¢â‚¬â„¢ÃƒÆ’Ã‚Â¢ÃƒÂ¢Ã¢â‚¬Å¡Ã‚Â¬Ãƒâ€šÃ‚Â ÃƒÆ’Ã†â€™Ãƒâ€šÃ‚Â¢ÃƒÆ’Ã‚Â¢ÃƒÂ¢Ã¢â€šÂ¬Ã…Â¡Ãƒâ€šÃ‚Â¬ÃƒÆ’Ã‚Â¢ÃƒÂ¢Ã¢â€šÂ¬Ã…Â¾Ãƒâ€šÃ‚Â¢ÃƒÆ’Ã†â€™Ãƒâ€ Ã¢â‚¬â„¢ÃƒÆ’Ã¢â‚¬Â ÃƒÂ¢Ã¢â€šÂ¬Ã¢â€žÂ¢ÃƒÆ’Ã†â€™ÃƒÂ¢Ã¢â€šÂ¬Ã…Â¡ÃƒÆ’Ã¢â‚¬Å¡Ãƒâ€šÃ‚Â¢ÃƒÆ’Ã†â€™Ãƒâ€ Ã¢â‚¬â„¢ÃƒÆ’Ã¢â‚¬Å¡Ãƒâ€šÃ‚Â¢ÃƒÆ’Ã†â€™Ãƒâ€šÃ‚Â¢ÃƒÆ’Ã‚Â¢ÃƒÂ¢Ã¢â€šÂ¬Ã…Â¡Ãƒâ€šÃ‚Â¬ÃƒÆ’Ã¢â‚¬Â¦Ãƒâ€šÃ‚Â¡ÃƒÆ’Ã†â€™ÃƒÂ¢Ã¢â€šÂ¬Ã…Â¡ÃƒÆ’Ã¢â‚¬Å¡Ãƒâ€šÃ‚Â¬ÃƒÆ’Ã†â€™Ãƒâ€ Ã¢â‚¬â„¢ÃƒÆ’Ã‚Â¢ÃƒÂ¢Ã¢â‚¬Å¡Ã‚Â¬Ãƒâ€šÃ‚Â¦ÃƒÆ’Ã†â€™ÃƒÂ¢Ã¢â€šÂ¬Ã…Â¡ÃƒÆ’Ã¢â‚¬Å¡Ãƒâ€šÃ‚Â¡ÃƒÆ’Ã†â€™Ãƒâ€ Ã¢â‚¬â„¢ÃƒÆ’Ã¢â‚¬Â ÃƒÂ¢Ã¢â€šÂ¬Ã¢â€žÂ¢ÃƒÆ’Ã†â€™ÃƒÂ¢Ã¢â€šÂ¬Ã‚Â ÃƒÆ’Ã‚Â¢ÃƒÂ¢Ã¢â‚¬Å¡Ã‚Â¬ÃƒÂ¢Ã¢â‚¬Å¾Ã‚Â¢ÃƒÆ’Ã†â€™Ãƒâ€ Ã¢â‚¬â„¢ÃƒÆ’Ã¢â‚¬Å¡Ãƒâ€šÃ‚Â¢ÃƒÆ’Ã†â€™Ãƒâ€šÃ‚Â¢ÃƒÆ’Ã‚Â¢ÃƒÂ¢Ã¢â‚¬Å¡Ã‚Â¬Ãƒâ€¦Ã‚Â¡ÃƒÆ’Ã¢â‚¬Å¡Ãƒâ€šÃ‚Â¬ÃƒÆ’Ã†â€™ÃƒÂ¢Ã¢â€šÂ¬Ã‚Â¦ÃƒÆ’Ã¢â‚¬Å¡Ãƒâ€šÃ‚Â¡ÃƒÆ’Ã†â€™Ãƒâ€ Ã¢â‚¬â„¢ÃƒÆ’Ã¢â‚¬Â ÃƒÂ¢Ã¢â€šÂ¬Ã¢â€žÂ¢ÃƒÆ’Ã†â€™Ãƒâ€šÃ‚Â¢ÃƒÆ’Ã‚Â¢ÃƒÂ¢Ã¢â€šÂ¬Ã…Â¡Ãƒâ€šÃ‚Â¬ÃƒÆ’Ã¢â‚¬Â¦Ãƒâ€šÃ‚Â¡ÃƒÆ’Ã†â€™Ãƒâ€ Ã¢â‚¬â„¢ÃƒÆ’Ã‚Â¢ÃƒÂ¢Ã¢â‚¬Å¡Ã‚Â¬Ãƒâ€¦Ã‚Â¡ÃƒÆ’Ã†â€™ÃƒÂ¢Ã¢â€šÂ¬Ã…Â¡ÃƒÆ’Ã¢â‚¬Å¡Ãƒâ€šÃ‚Â³ÃƒÆ’Ã†â€™Ãƒâ€ Ã¢â‚¬â„¢ÃƒÆ’Ã¢â‚¬Â ÃƒÂ¢Ã¢â€šÂ¬Ã¢â€žÂ¢ÃƒÆ’Ã†â€™ÃƒÂ¢Ã¢â€šÂ¬Ã‚Â ÃƒÆ’Ã‚Â¢ÃƒÂ¢Ã¢â‚¬Å¡Ã‚Â¬ÃƒÂ¢Ã¢â‚¬Å¾Ã‚Â¢ÃƒÆ’Ã†â€™Ãƒâ€ Ã¢â‚¬â„¢ÃƒÆ’Ã‚Â¢ÃƒÂ¢Ã¢â‚¬Å¡Ã‚Â¬Ãƒâ€šÃ‚Â ÃƒÆ’Ã†â€™Ãƒâ€šÃ‚Â¢ÃƒÆ’Ã‚Â¢ÃƒÂ¢Ã¢â€šÂ¬Ã…Â¡Ãƒâ€šÃ‚Â¬ÃƒÆ’Ã‚Â¢ÃƒÂ¢Ã¢â€šÂ¬Ã…Â¾Ãƒâ€šÃ‚Â¢ÃƒÆ’Ã†â€™Ãƒâ€ Ã¢â‚¬â„¢ÃƒÆ’Ã¢â‚¬Â ÃƒÂ¢Ã¢â€šÂ¬Ã¢â€žÂ¢ÃƒÆ’Ã†â€™Ãƒâ€šÃ‚Â¢ÃƒÆ’Ã‚Â¢ÃƒÂ¢Ã¢â€šÂ¬Ã…Â¡Ãƒâ€šÃ‚Â¬ÃƒÆ’Ã¢â‚¬Å¡Ãƒâ€šÃ‚Â ÃƒÆ’Ã†â€™Ãƒâ€ Ã¢â‚¬â„¢ÃƒÆ’Ã¢â‚¬Å¡Ãƒâ€šÃ‚Â¢ÃƒÆ’Ã†â€™Ãƒâ€šÃ‚Â¢ÃƒÆ’Ã‚Â¢ÃƒÂ¢Ã¢â‚¬Å¡Ã‚Â¬Ãƒâ€¦Ã‚Â¡ÃƒÆ’Ã¢â‚¬Å¡Ãƒâ€šÃ‚Â¬ÃƒÆ’Ã†â€™Ãƒâ€šÃ‚Â¢ÃƒÆ’Ã‚Â¢ÃƒÂ¢Ã¢â‚¬Å¡Ã‚Â¬Ãƒâ€¦Ã‚Â¾ÃƒÆ’Ã¢â‚¬Å¡Ãƒâ€šÃ‚Â¢ÃƒÆ’Ã†â€™Ãƒâ€ Ã¢â‚¬â„¢ÃƒÆ’Ã¢â‚¬Â ÃƒÂ¢Ã¢â€šÂ¬Ã¢â€žÂ¢ÃƒÆ’Ã†â€™ÃƒÂ¢Ã¢â€šÂ¬Ã‚Â ÃƒÆ’Ã‚Â¢ÃƒÂ¢Ã¢â‚¬Å¡Ã‚Â¬ÃƒÂ¢Ã¢â‚¬Å¾Ã‚Â¢ÃƒÆ’Ã†â€™Ãƒâ€ Ã¢â‚¬â„¢ÃƒÆ’Ã¢â‚¬Å¡Ãƒâ€šÃ‚Â¢ÃƒÆ’Ã†â€™Ãƒâ€šÃ‚Â¢ÃƒÆ’Ã‚Â¢ÃƒÂ¢Ã¢â‚¬Å¡Ã‚Â¬Ãƒâ€¦Ã‚Â¡ÃƒÆ’Ã¢â‚¬Å¡Ãƒâ€šÃ‚Â¬ÃƒÆ’Ã†â€™ÃƒÂ¢Ã¢â€šÂ¬Ã‚Â¦ÃƒÆ’Ã¢â‚¬Å¡Ãƒâ€šÃ‚Â¡ÃƒÆ’Ã†â€™Ãƒâ€ Ã¢â‚¬â„¢ÃƒÆ’Ã¢â‚¬Â ÃƒÂ¢Ã¢â€šÂ¬Ã¢â€žÂ¢ÃƒÆ’Ã†â€™Ãƒâ€šÃ‚Â¢ÃƒÆ’Ã‚Â¢ÃƒÂ¢Ã¢â€šÂ¬Ã…Â¡Ãƒâ€šÃ‚Â¬ÃƒÆ’Ã¢â‚¬Â¦Ãƒâ€šÃ‚Â¡ÃƒÆ’Ã†â€™Ãƒâ€ Ã¢â‚¬â„¢ÃƒÆ’Ã‚Â¢ÃƒÂ¢Ã¢â‚¬Å¡Ã‚Â¬Ãƒâ€¦Ã‚Â¡ÃƒÆ’Ã†â€™ÃƒÂ¢Ã¢â€šÂ¬Ã…Â¡ÃƒÆ’Ã¢â‚¬Å¡Ãƒâ€šÃ‚Â¢ÃƒÆ’Ã†â€™Ãƒâ€ Ã¢â‚¬â„¢ÃƒÆ’Ã¢â‚¬Â ÃƒÂ¢Ã¢â€šÂ¬Ã¢â€žÂ¢ÃƒÆ’Ã†â€™ÃƒÂ¢Ã¢â€šÂ¬Ã‚Â ÃƒÆ’Ã‚Â¢ÃƒÂ¢Ã¢â‚¬Å¡Ã‚Â¬ÃƒÂ¢Ã¢â‚¬Å¾Ã‚Â¢ÃƒÆ’Ã†â€™Ãƒâ€ Ã¢â‚¬â„¢ÃƒÆ’Ã‚Â¢ÃƒÂ¢Ã¢â‚¬Å¡Ã‚Â¬Ãƒâ€šÃ‚Â ÃƒÆ’Ã†â€™Ãƒâ€šÃ‚Â¢ÃƒÆ’Ã‚Â¢ÃƒÂ¢Ã¢â€šÂ¬Ã…Â¡Ãƒâ€šÃ‚Â¬ÃƒÆ’Ã‚Â¢ÃƒÂ¢Ã¢â€šÂ¬Ã…Â¾Ãƒâ€šÃ‚Â¢ÃƒÆ’Ã†â€™Ãƒâ€ Ã¢â‚¬â„¢ÃƒÆ’Ã¢â‚¬Â ÃƒÂ¢Ã¢â€šÂ¬Ã¢â€žÂ¢ÃƒÆ’Ã†â€™ÃƒÂ¢Ã¢â€šÂ¬Ã…Â¡ÃƒÆ’Ã¢â‚¬Å¡Ãƒâ€šÃ‚Â¢ÃƒÆ’Ã†â€™Ãƒâ€ Ã¢â‚¬â„¢ÃƒÆ’Ã¢â‚¬Å¡Ãƒâ€šÃ‚Â¢ÃƒÆ’Ã†â€™Ãƒâ€šÃ‚Â¢ÃƒÆ’Ã‚Â¢ÃƒÂ¢Ã¢â€šÂ¬Ã…Â¡Ãƒâ€šÃ‚Â¬ÃƒÆ’Ã¢â‚¬Â¦Ãƒâ€šÃ‚Â¡ÃƒÆ’Ã†â€™ÃƒÂ¢Ã¢â€šÂ¬Ã…Â¡ÃƒÆ’Ã¢â‚¬Å¡Ãƒâ€šÃ‚Â¬ÃƒÆ’Ã†â€™Ãƒâ€ Ã¢â‚¬â„¢ÃƒÆ’Ã‚Â¢ÃƒÂ¢Ã¢â‚¬Å¡Ã‚Â¬Ãƒâ€šÃ‚Â¦ÃƒÆ’Ã†â€™ÃƒÂ¢Ã¢â€šÂ¬Ã…Â¡ÃƒÆ’Ã¢â‚¬Å¡Ãƒâ€šÃ‚Â¡ÃƒÆ’Ã†â€™Ãƒâ€ Ã¢â‚¬â„¢ÃƒÆ’Ã¢â‚¬Â ÃƒÂ¢Ã¢â€šÂ¬Ã¢â€žÂ¢ÃƒÆ’Ã†â€™ÃƒÂ¢Ã¢â€šÂ¬Ã‚Â ÃƒÆ’Ã‚Â¢ÃƒÂ¢Ã¢â‚¬Å¡Ã‚Â¬ÃƒÂ¢Ã¢â‚¬Å¾Ã‚Â¢ÃƒÆ’Ã†â€™Ãƒâ€ Ã¢â‚¬â„¢ÃƒÆ’Ã¢â‚¬Å¡Ãƒâ€šÃ‚Â¢ÃƒÆ’Ã†â€™Ãƒâ€šÃ‚Â¢ÃƒÆ’Ã‚Â¢ÃƒÂ¢Ã¢â‚¬Å¡Ã‚Â¬Ãƒâ€¦Ã‚Â¡ÃƒÆ’Ã¢â‚¬Å¡Ãƒâ€šÃ‚Â¬ÃƒÆ’Ã†â€™ÃƒÂ¢Ã¢â€šÂ¬Ã‚Â¦ÃƒÆ’Ã¢â‚¬Å¡Ãƒâ€šÃ‚Â¡ÃƒÆ’Ã†â€™Ãƒâ€ Ã¢â‚¬â„¢ÃƒÆ’Ã¢â‚¬Â ÃƒÂ¢Ã¢â€šÂ¬Ã¢â€žÂ¢ÃƒÆ’Ã†â€™Ãƒâ€šÃ‚Â¢ÃƒÆ’Ã‚Â¢ÃƒÂ¢Ã¢â€šÂ¬Ã…Â¡Ãƒâ€šÃ‚Â¬ÃƒÆ’Ã¢â‚¬Â¦Ãƒâ€šÃ‚Â¡ÃƒÆ’Ã†â€™Ãƒâ€ Ã¢â‚¬â„¢ÃƒÆ’Ã‚Â¢ÃƒÂ¢Ã¢â‚¬Å¡Ã‚Â¬Ãƒâ€¦Ã‚Â¡ÃƒÆ’Ã†â€™ÃƒÂ¢Ã¢â€šÂ¬Ã…Â¡ÃƒÆ’Ã¢â‚¬Å¡Ãƒâ€šÃ‚ÂÃƒÆ’Ã†â€™Ãƒâ€ Ã¢â‚¬â„¢ÃƒÆ’Ã¢â‚¬Â ÃƒÂ¢Ã¢â€šÂ¬Ã¢â€žÂ¢ÃƒÆ’Ã†â€™ÃƒÂ¢Ã¢â€šÂ¬Ã‚Â ÃƒÆ’Ã‚Â¢ÃƒÂ¢Ã¢â‚¬Å¡Ã‚Â¬ÃƒÂ¢Ã¢â‚¬Å¾Ã‚Â¢ÃƒÆ’Ã†â€™Ãƒâ€ Ã¢â‚¬â„¢ÃƒÆ’Ã‚Â¢ÃƒÂ¢Ã¢â‚¬Å¡Ã‚Â¬Ãƒâ€šÃ‚Â ÃƒÆ’Ã†â€™Ãƒâ€šÃ‚Â¢ÃƒÆ’Ã‚Â¢ÃƒÂ¢Ã¢â€šÂ¬Ã…Â¡Ãƒâ€šÃ‚Â¬ÃƒÆ’Ã‚Â¢ÃƒÂ¢Ã¢â€šÂ¬Ã…Â¾Ãƒâ€šÃ‚Â¢ÃƒÆ’Ã†â€™Ãƒâ€ Ã¢â‚¬â„¢ÃƒÆ’Ã¢â‚¬Â ÃƒÂ¢Ã¢â€šÂ¬Ã¢â€žÂ¢ÃƒÆ’Ã†â€™ÃƒÂ¢Ã¢â€šÂ¬Ã…Â¡ÃƒÆ’Ã¢â‚¬Å¡Ãƒâ€šÃ‚Â¢ÃƒÆ’Ã†â€™Ãƒâ€ Ã¢â‚¬â„¢ÃƒÆ’Ã¢â‚¬Å¡Ãƒâ€šÃ‚Â¢ÃƒÆ’Ã†â€™Ãƒâ€šÃ‚Â¢ÃƒÆ’Ã‚Â¢ÃƒÂ¢Ã¢â€šÂ¬Ã…Â¡Ãƒâ€šÃ‚Â¬ÃƒÆ’Ã¢â‚¬Â¦Ãƒâ€šÃ‚Â¡ÃƒÆ’Ã†â€™ÃƒÂ¢Ã¢â€šÂ¬Ã…Â¡ÃƒÆ’Ã¢â‚¬Å¡Ãƒâ€šÃ‚Â¬ÃƒÆ’Ã†â€™Ãƒâ€ Ã¢â‚¬â„¢ÃƒÆ’Ã‚Â¢ÃƒÂ¢Ã¢â‚¬Å¡Ã‚Â¬Ãƒâ€šÃ‚Â¦ÃƒÆ’Ã†â€™ÃƒÂ¢Ã¢â€šÂ¬Ã…Â¡ÃƒÆ’Ã¢â‚¬Å¡Ãƒâ€šÃ‚Â¡ÃƒÆ’Ã†â€™Ãƒâ€ Ã¢â‚¬â„¢ÃƒÆ’Ã¢â‚¬Â ÃƒÂ¢Ã¢â€šÂ¬Ã¢â€žÂ¢ÃƒÆ’Ã†â€™ÃƒÂ¢Ã¢â€šÂ¬Ã‚Â ÃƒÆ’Ã‚Â¢ÃƒÂ¢Ã¢â‚¬Å¡Ã‚Â¬ÃƒÂ¢Ã¢â‚¬Å¾Ã‚Â¢ÃƒÆ’Ã†â€™Ãƒâ€ Ã¢â‚¬â„¢ÃƒÆ’Ã¢â‚¬Å¡Ãƒâ€šÃ‚Â¢ÃƒÆ’Ã†â€™Ãƒâ€šÃ‚Â¢ÃƒÆ’Ã‚Â¢ÃƒÂ¢Ã¢â‚¬Å¡Ã‚Â¬Ãƒâ€¦Ã‚Â¡ÃƒÆ’Ã¢â‚¬Å¡Ãƒâ€šÃ‚Â¬ÃƒÆ’Ã†â€™ÃƒÂ¢Ã¢â€šÂ¬Ã‚Â¦ÃƒÆ’Ã¢â‚¬Å¡Ãƒâ€šÃ‚Â¡ÃƒÆ’Ã†â€™Ãƒâ€ Ã¢â‚¬â„¢ÃƒÆ’Ã¢â‚¬Â ÃƒÂ¢Ã¢â€šÂ¬Ã¢â€žÂ¢ÃƒÆ’Ã†â€™Ãƒâ€šÃ‚Â¢ÃƒÆ’Ã‚Â¢ÃƒÂ¢Ã¢â€šÂ¬Ã…Â¡Ãƒâ€šÃ‚Â¬ÃƒÆ’Ã¢â‚¬Â¦Ãƒâ€šÃ‚Â¡ÃƒÆ’Ã†â€™Ãƒâ€ Ã¢â‚¬â„¢ÃƒÆ’Ã‚Â¢ÃƒÂ¢Ã¢â‚¬Å¡Ã‚Â¬Ãƒâ€¦Ã‚Â¡ÃƒÆ’Ã†â€™ÃƒÂ¢Ã¢â€šÂ¬Ã…Â¡ÃƒÆ’Ã¢â‚¬Å¡Ãƒâ€šÃ‚Â») concentration (</w:t>
       </w:r>
       <w:proofErr w:type="spellStart"/>
       <w:r>
@@ -8896,7 +8896,7 @@
           <w:sz w:val="28"/>
           <w:szCs w:val="28"/>
         </w:rPr>
-        <w:t>ÃƒÆ’Ã†â€™Ãƒâ€ Ã¢â‚¬â„¢ÃƒÆ’Ã¢â‚¬Â ÃƒÂ¢Ã¢â€šÂ¬Ã¢â€žÂ¢ÃƒÆ’Ã†â€™ÃƒÂ¢Ã¢â€šÂ¬Ã‚Â ÃƒÆ’Ã‚Â¢ÃƒÂ¢Ã¢â‚¬Å¡Ã‚Â¬ÃƒÂ¢Ã¢â‚¬Å¾Ã‚Â¢ÃƒÆ’Ã†â€™Ãƒâ€ Ã¢â‚¬â„¢ÃƒÆ’Ã‚Â¢ÃƒÂ¢Ã¢â‚¬Å¡Ã‚Â¬Ãƒâ€šÃ‚Â¦ÃƒÆ’Ã†â€™ÃƒÂ¢Ã¢â€šÂ¬Ã…Â¡ÃƒÆ’Ã¢â‚¬Å¡Ãƒâ€šÃ‚Â½ÃƒÆ’Ã†â€™Ãƒâ€ Ã¢â‚¬â„¢ÃƒÆ’Ã¢â‚¬Â ÃƒÂ¢Ã¢â€šÂ¬Ã¢â€žÂ¢ÃƒÆ’Ã†â€™Ãƒâ€šÃ‚Â¢ÃƒÆ’Ã‚Â¢ÃƒÂ¢Ã¢â€šÂ¬Ã…Â¡Ãƒâ€šÃ‚Â¬ÃƒÆ’Ã¢â‚¬Â¦Ãƒâ€šÃ‚Â¡ÃƒÆ’Ã†â€™Ãƒâ€ Ã¢â‚¬â„¢ÃƒÆ’Ã‚Â¢ÃƒÂ¢Ã¢â‚¬Å¡Ã‚Â¬Ãƒâ€¦Ã‚Â¡ÃƒÆ’Ã†â€™ÃƒÂ¢Ã¢â€šÂ¬Ã…Â¡ÃƒÆ’Ã¢â‚¬Å¡Ãƒâ€šÃ‚Â¼g</w:t>
+        <w:t>ÃƒÆ’Ã†â€™Ãƒâ€ Ã¢â‚¬â„¢ÃƒÆ’Ã¢â‚¬Â ÃƒÂ¢Ã¢â€šÂ¬Ã¢â€žÂ¢ÃƒÆ’Ã†â€™ÃƒÂ¢Ã¢â€šÂ¬Ã‚Â ÃƒÆ’Ã‚Â¢ÃƒÂ¢Ã¢â‚¬Å¡Ã‚Â¬ÃƒÂ¢Ã¢â‚¬Å¾Ã‚Â¢ÃƒÆ’Ã†â€™Ãƒâ€ Ã¢â‚¬â„¢ÃƒÆ’Ã‚Â¢ÃƒÂ¢Ã¢â‚¬Å¡Ã‚Â¬Ãƒâ€šÃ‚Â ÃƒÆ’Ã†â€™Ãƒâ€šÃ‚Â¢ÃƒÆ’Ã‚Â¢ÃƒÂ¢Ã¢â€šÂ¬Ã…Â¡Ãƒâ€šÃ‚Â¬ÃƒÆ’Ã‚Â¢ÃƒÂ¢Ã¢â€šÂ¬Ã…Â¾Ãƒâ€šÃ‚Â¢ÃƒÆ’Ã†â€™Ãƒâ€ Ã¢â‚¬â„¢ÃƒÆ’Ã¢â‚¬Â ÃƒÂ¢Ã¢â€šÂ¬Ã¢â€žÂ¢ÃƒÆ’Ã†â€™Ãƒâ€šÃ‚Â¢ÃƒÆ’Ã‚Â¢ÃƒÂ¢Ã¢â€šÂ¬Ã…Â¡Ãƒâ€šÃ‚Â¬ÃƒÆ’Ã¢â‚¬Å¡Ãƒâ€šÃ‚Â ÃƒÆ’Ã†â€™Ãƒâ€ Ã¢â‚¬â„¢ÃƒÆ’Ã¢â‚¬Å¡Ãƒâ€šÃ‚Â¢ÃƒÆ’Ã†â€™Ãƒâ€šÃ‚Â¢ÃƒÆ’Ã‚Â¢ÃƒÂ¢Ã¢â‚¬Å¡Ã‚Â¬Ãƒâ€¦Ã‚Â¡ÃƒÆ’Ã¢â‚¬Å¡Ãƒâ€šÃ‚Â¬ÃƒÆ’Ã†â€™Ãƒâ€šÃ‚Â¢ÃƒÆ’Ã‚Â¢ÃƒÂ¢Ã¢â‚¬Å¡Ã‚Â¬Ãƒâ€¦Ã‚Â¾ÃƒÆ’Ã¢â‚¬Å¡Ãƒâ€šÃ‚Â¢ÃƒÆ’Ã†â€™Ãƒâ€ Ã¢â‚¬â„¢ÃƒÆ’Ã¢â‚¬Â ÃƒÂ¢Ã¢â€šÂ¬Ã¢â€žÂ¢ÃƒÆ’Ã†â€™ÃƒÂ¢Ã¢â€šÂ¬Ã‚Â ÃƒÆ’Ã‚Â¢ÃƒÂ¢Ã¢â‚¬Å¡Ã‚Â¬ÃƒÂ¢Ã¢â‚¬Å¾Ã‚Â¢ÃƒÆ’Ã†â€™Ãƒâ€ Ã¢â‚¬â„¢ÃƒÆ’Ã¢â‚¬Å¡Ãƒâ€šÃ‚Â¢ÃƒÆ’Ã†â€™Ãƒâ€šÃ‚Â¢ÃƒÆ’Ã‚Â¢ÃƒÂ¢Ã¢â‚¬Å¡Ã‚Â¬Ãƒâ€¦Ã‚Â¡ÃƒÆ’Ã¢â‚¬Å¡Ãƒâ€šÃ‚Â¬ÃƒÆ’Ã†â€™ÃƒÂ¢Ã¢â€šÂ¬Ã…Â¡ÃƒÆ’Ã¢â‚¬Å¡Ãƒâ€šÃ‚Â¦ÃƒÆ’Ã†â€™Ãƒâ€ Ã¢â‚¬â„¢ÃƒÆ’Ã¢â‚¬Â ÃƒÂ¢Ã¢â€šÂ¬Ã¢â€žÂ¢ÃƒÆ’Ã†â€™Ãƒâ€šÃ‚Â¢ÃƒÆ’Ã‚Â¢ÃƒÂ¢Ã¢â€šÂ¬Ã…Â¡Ãƒâ€šÃ‚Â¬ÃƒÆ’Ã¢â‚¬Â¦Ãƒâ€šÃ‚Â¡ÃƒÆ’Ã†â€™Ãƒâ€ Ã¢â‚¬â„¢ÃƒÆ’Ã‚Â¢ÃƒÂ¢Ã¢â‚¬Å¡Ã‚Â¬Ãƒâ€¦Ã‚Â¡ÃƒÆ’Ã†â€™ÃƒÂ¢Ã¢â€šÂ¬Ã…Â¡ÃƒÆ’Ã¢â‚¬Å¡Ãƒâ€šÃ‚Â½ÃƒÆ’Ã†â€™Ãƒâ€ Ã¢â‚¬â„¢ÃƒÆ’Ã¢â‚¬Â ÃƒÂ¢Ã¢â€šÂ¬Ã¢â€žÂ¢ÃƒÆ’Ã†â€™ÃƒÂ¢Ã¢â€šÂ¬Ã‚Â ÃƒÆ’Ã‚Â¢ÃƒÂ¢Ã¢â‚¬Å¡Ã‚Â¬ÃƒÂ¢Ã¢â‚¬Å¾Ã‚Â¢ÃƒÆ’Ã†â€™Ãƒâ€ Ã¢â‚¬â„¢ÃƒÆ’Ã‚Â¢ÃƒÂ¢Ã¢â‚¬Å¡Ã‚Â¬Ãƒâ€šÃ‚Â ÃƒÆ’Ã†â€™Ãƒâ€šÃ‚Â¢ÃƒÆ’Ã‚Â¢ÃƒÂ¢Ã¢â€šÂ¬Ã…Â¡Ãƒâ€šÃ‚Â¬ÃƒÆ’Ã‚Â¢ÃƒÂ¢Ã¢â€šÂ¬Ã…Â¾Ãƒâ€šÃ‚Â¢ÃƒÆ’Ã†â€™Ãƒâ€ Ã¢â‚¬â„¢ÃƒÆ’Ã¢â‚¬Â ÃƒÂ¢Ã¢â€šÂ¬Ã¢â€žÂ¢ÃƒÆ’Ã†â€™ÃƒÂ¢Ã¢â€šÂ¬Ã…Â¡ÃƒÆ’Ã¢â‚¬Å¡Ãƒâ€šÃ‚Â¢ÃƒÆ’Ã†â€™Ãƒâ€ Ã¢â‚¬â„¢ÃƒÆ’Ã¢â‚¬Å¡Ãƒâ€šÃ‚Â¢ÃƒÆ’Ã†â€™Ãƒâ€šÃ‚Â¢ÃƒÆ’Ã‚Â¢ÃƒÂ¢Ã¢â€šÂ¬Ã…Â¡Ãƒâ€šÃ‚Â¬ÃƒÆ’Ã¢â‚¬Â¦Ãƒâ€šÃ‚Â¡ÃƒÆ’Ã†â€™ÃƒÂ¢Ã¢â€šÂ¬Ã…Â¡ÃƒÆ’Ã¢â‚¬Å¡Ãƒâ€šÃ‚Â¬ÃƒÆ’Ã†â€™Ãƒâ€ Ã¢â‚¬â„¢ÃƒÆ’Ã‚Â¢ÃƒÂ¢Ã¢â‚¬Å¡Ã‚Â¬Ãƒâ€šÃ‚Â¦ÃƒÆ’Ã†â€™ÃƒÂ¢Ã¢â€šÂ¬Ã…Â¡ÃƒÆ’Ã¢â‚¬Å¡Ãƒâ€šÃ‚Â¡ÃƒÆ’Ã†â€™Ãƒâ€ Ã¢â‚¬â„¢ÃƒÆ’Ã¢â‚¬Â ÃƒÂ¢Ã¢â€šÂ¬Ã¢â€žÂ¢ÃƒÆ’Ã†â€™ÃƒÂ¢Ã¢â€šÂ¬Ã‚Â ÃƒÆ’Ã‚Â¢ÃƒÂ¢Ã¢â‚¬Å¡Ã‚Â¬ÃƒÂ¢Ã¢â‚¬Å¾Ã‚Â¢ÃƒÆ’Ã†â€™Ãƒâ€ Ã¢â‚¬â„¢ÃƒÆ’Ã¢â‚¬Å¡Ãƒâ€šÃ‚Â¢ÃƒÆ’Ã†â€™Ãƒâ€šÃ‚Â¢ÃƒÆ’Ã‚Â¢ÃƒÂ¢Ã¢â‚¬Å¡Ã‚Â¬Ãƒâ€¦Ã‚Â¡ÃƒÆ’Ã¢â‚¬Å¡Ãƒâ€šÃ‚Â¬ÃƒÆ’Ã†â€™ÃƒÂ¢Ã¢â€šÂ¬Ã‚Â¦ÃƒÆ’Ã¢â‚¬Å¡Ãƒâ€šÃ‚Â¡ÃƒÆ’Ã†â€™Ãƒâ€ Ã¢â‚¬â„¢ÃƒÆ’Ã¢â‚¬Â ÃƒÂ¢Ã¢â€šÂ¬Ã¢â€žÂ¢ÃƒÆ’Ã†â€™Ãƒâ€šÃ‚Â¢ÃƒÆ’Ã‚Â¢ÃƒÂ¢Ã¢â€šÂ¬Ã…Â¡Ãƒâ€šÃ‚Â¬ÃƒÆ’Ã¢â‚¬Â¦Ãƒâ€šÃ‚Â¡ÃƒÆ’Ã†â€™Ãƒâ€ Ã¢â‚¬â„¢ÃƒÆ’Ã‚Â¢ÃƒÂ¢Ã¢â‚¬Å¡Ã‚Â¬Ãƒâ€¦Ã‚Â¡ÃƒÆ’Ã†â€™ÃƒÂ¢Ã¢â€šÂ¬Ã…Â¡ÃƒÆ’Ã¢â‚¬Å¡Ãƒâ€šÃ‚Â¼g</w:t>
       </w:r>
       <w:proofErr w:type="spellEnd"/>
       <w:r>
@@ -8914,7 +8914,7 @@
           <w:sz w:val="28"/>
           <w:szCs w:val="28"/>
         </w:rPr>
-        <w:t>ÃƒÆ’Ã†â€™Ãƒâ€ Ã¢â‚¬â„¢ÃƒÆ’Ã¢â‚¬Â ÃƒÂ¢Ã¢â€šÂ¬Ã¢â€žÂ¢ÃƒÆ’Ã†â€™ÃƒÂ¢Ã¢â€šÂ¬Ã‚Â ÃƒÆ’Ã‚Â¢ÃƒÂ¢Ã¢â‚¬Å¡Ã‚Â¬ÃƒÂ¢Ã¢â‚¬Å¾Ã‚Â¢ÃƒÆ’Ã†â€™Ãƒâ€ Ã¢â‚¬â„¢ÃƒÆ’Ã‚Â¢ÃƒÂ¢Ã¢â‚¬Å¡Ã‚Â¬Ãƒâ€šÃ‚Â¦ÃƒÆ’Ã†â€™ÃƒÂ¢Ã¢â€šÂ¬Ã…Â¡ÃƒÆ’Ã¢â‚¬Å¡Ãƒâ€šÃ‚Â½ÃƒÆ’Ã†â€™Ãƒâ€ Ã¢â‚¬â„¢ÃƒÆ’Ã¢â‚¬Â ÃƒÂ¢Ã¢â€šÂ¬Ã¢â€žÂ¢ÃƒÆ’Ã†â€™Ãƒâ€šÃ‚Â¢ÃƒÆ’Ã‚Â¢ÃƒÂ¢Ã¢â€šÂ¬Ã…Â¡Ãƒâ€šÃ‚Â¬ÃƒÆ’Ã¢â‚¬Â¦Ãƒâ€šÃ‚Â¡ÃƒÆ’Ã†â€™Ãƒâ€ Ã¢â‚¬â„¢ÃƒÆ’Ã‚Â¢ÃƒÂ¢Ã¢â‚¬Å¡Ã‚Â¬Ãƒâ€¦Ã‚Â¡ÃƒÆ’Ã†â€™ÃƒÂ¢Ã¢â€šÂ¬Ã…Â¡ÃƒÆ’Ã¢â‚¬Å¡Ãƒâ€šÃ‚Â¼g</w:t>
+        <w:t>ÃƒÆ’Ã†â€™Ãƒâ€ Ã¢â‚¬â„¢ÃƒÆ’Ã¢â‚¬Â ÃƒÂ¢Ã¢â€šÂ¬Ã¢â€žÂ¢ÃƒÆ’Ã†â€™ÃƒÂ¢Ã¢â€šÂ¬Ã‚Â ÃƒÆ’Ã‚Â¢ÃƒÂ¢Ã¢â‚¬Å¡Ã‚Â¬ÃƒÂ¢Ã¢â‚¬Å¾Ã‚Â¢ÃƒÆ’Ã†â€™Ãƒâ€ Ã¢â‚¬â„¢ÃƒÆ’Ã‚Â¢ÃƒÂ¢Ã¢â‚¬Å¡Ã‚Â¬Ãƒâ€šÃ‚Â ÃƒÆ’Ã†â€™Ãƒâ€šÃ‚Â¢ÃƒÆ’Ã‚Â¢ÃƒÂ¢Ã¢â€šÂ¬Ã…Â¡Ãƒâ€šÃ‚Â¬ÃƒÆ’Ã‚Â¢ÃƒÂ¢Ã¢â€šÂ¬Ã…Â¾Ãƒâ€šÃ‚Â¢ÃƒÆ’Ã†â€™Ãƒâ€ Ã¢â‚¬â„¢ÃƒÆ’Ã¢â‚¬Â ÃƒÂ¢Ã¢â€šÂ¬Ã¢â€žÂ¢ÃƒÆ’Ã†â€™Ãƒâ€šÃ‚Â¢ÃƒÆ’Ã‚Â¢ÃƒÂ¢Ã¢â€šÂ¬Ã…Â¡Ãƒâ€šÃ‚Â¬ÃƒÆ’Ã¢â‚¬Å¡Ãƒâ€šÃ‚Â ÃƒÆ’Ã†â€™Ãƒâ€ Ã¢â‚¬â„¢ÃƒÆ’Ã¢â‚¬Å¡Ãƒâ€šÃ‚Â¢ÃƒÆ’Ã†â€™Ãƒâ€šÃ‚Â¢ÃƒÆ’Ã‚Â¢ÃƒÂ¢Ã¢â‚¬Å¡Ã‚Â¬Ãƒâ€¦Ã‚Â¡ÃƒÆ’Ã¢â‚¬Å¡Ãƒâ€šÃ‚Â¬ÃƒÆ’Ã†â€™Ãƒâ€šÃ‚Â¢ÃƒÆ’Ã‚Â¢ÃƒÂ¢Ã¢â‚¬Å¡Ã‚Â¬Ãƒâ€¦Ã‚Â¾ÃƒÆ’Ã¢â‚¬Å¡Ãƒâ€šÃ‚Â¢ÃƒÆ’Ã†â€™Ãƒâ€ Ã¢â‚¬â„¢ÃƒÆ’Ã¢â‚¬Â ÃƒÂ¢Ã¢â€šÂ¬Ã¢â€žÂ¢ÃƒÆ’Ã†â€™ÃƒÂ¢Ã¢â€šÂ¬Ã‚Â ÃƒÆ’Ã‚Â¢ÃƒÂ¢Ã¢â‚¬Å¡Ã‚Â¬ÃƒÂ¢Ã¢â‚¬Å¾Ã‚Â¢ÃƒÆ’Ã†â€™Ãƒâ€ Ã¢â‚¬â„¢ÃƒÆ’Ã¢â‚¬Å¡Ãƒâ€šÃ‚Â¢ÃƒÆ’Ã†â€™Ãƒâ€šÃ‚Â¢ÃƒÆ’Ã‚Â¢ÃƒÂ¢Ã¢â‚¬Å¡Ã‚Â¬Ãƒâ€¦Ã‚Â¡ÃƒÆ’Ã¢â‚¬Å¡Ãƒâ€šÃ‚Â¬ÃƒÆ’Ã†â€™ÃƒÂ¢Ã¢â€šÂ¬Ã…Â¡ÃƒÆ’Ã¢â‚¬Å¡Ãƒâ€šÃ‚Â¦ÃƒÆ’Ã†â€™Ãƒâ€ Ã¢â‚¬â„¢ÃƒÆ’Ã¢â‚¬Â ÃƒÂ¢Ã¢â€šÂ¬Ã¢â€žÂ¢ÃƒÆ’Ã†â€™Ãƒâ€šÃ‚Â¢ÃƒÆ’Ã‚Â¢ÃƒÂ¢Ã¢â€šÂ¬Ã…Â¡Ãƒâ€šÃ‚Â¬ÃƒÆ’Ã¢â‚¬Â¦Ãƒâ€šÃ‚Â¡ÃƒÆ’Ã†â€™Ãƒâ€ Ã¢â‚¬â„¢ÃƒÆ’Ã‚Â¢ÃƒÂ¢Ã¢â‚¬Å¡Ã‚Â¬Ãƒâ€¦Ã‚Â¡ÃƒÆ’Ã†â€™ÃƒÂ¢Ã¢â€šÂ¬Ã…Â¡ÃƒÆ’Ã¢â‚¬Å¡Ãƒâ€šÃ‚Â½ÃƒÆ’Ã†â€™Ãƒâ€ Ã¢â‚¬â„¢ÃƒÆ’Ã¢â‚¬Â ÃƒÂ¢Ã¢â€šÂ¬Ã¢â€žÂ¢ÃƒÆ’Ã†â€™ÃƒÂ¢Ã¢â€šÂ¬Ã‚Â ÃƒÆ’Ã‚Â¢ÃƒÂ¢Ã¢â‚¬Å¡Ã‚Â¬ÃƒÂ¢Ã¢â‚¬Å¾Ã‚Â¢ÃƒÆ’Ã†â€™Ãƒâ€ Ã¢â‚¬â„¢ÃƒÆ’Ã‚Â¢ÃƒÂ¢Ã¢â‚¬Å¡Ã‚Â¬Ãƒâ€šÃ‚Â ÃƒÆ’Ã†â€™Ãƒâ€šÃ‚Â¢ÃƒÆ’Ã‚Â¢ÃƒÂ¢Ã¢â€šÂ¬Ã…Â¡Ãƒâ€šÃ‚Â¬ÃƒÆ’Ã‚Â¢ÃƒÂ¢Ã¢â€šÂ¬Ã…Â¾Ãƒâ€šÃ‚Â¢ÃƒÆ’Ã†â€™Ãƒâ€ Ã¢â‚¬â„¢ÃƒÆ’Ã¢â‚¬Â ÃƒÂ¢Ã¢â€šÂ¬Ã¢â€žÂ¢ÃƒÆ’Ã†â€™ÃƒÂ¢Ã¢â€šÂ¬Ã…Â¡ÃƒÆ’Ã¢â‚¬Å¡Ãƒâ€šÃ‚Â¢ÃƒÆ’Ã†â€™Ãƒâ€ Ã¢â‚¬â„¢ÃƒÆ’Ã¢â‚¬Å¡Ãƒâ€šÃ‚Â¢ÃƒÆ’Ã†â€™Ãƒâ€šÃ‚Â¢ÃƒÆ’Ã‚Â¢ÃƒÂ¢Ã¢â€šÂ¬Ã…Â¡Ãƒâ€šÃ‚Â¬ÃƒÆ’Ã¢â‚¬Â¦Ãƒâ€šÃ‚Â¡ÃƒÆ’Ã†â€™ÃƒÂ¢Ã¢â€šÂ¬Ã…Â¡ÃƒÆ’Ã¢â‚¬Å¡Ãƒâ€šÃ‚Â¬ÃƒÆ’Ã†â€™Ãƒâ€ Ã¢â‚¬â„¢ÃƒÆ’Ã‚Â¢ÃƒÂ¢Ã¢â‚¬Å¡Ã‚Â¬Ãƒâ€šÃ‚Â¦ÃƒÆ’Ã†â€™ÃƒÂ¢Ã¢â€šÂ¬Ã…Â¡ÃƒÆ’Ã¢â‚¬Å¡Ãƒâ€šÃ‚Â¡ÃƒÆ’Ã†â€™Ãƒâ€ Ã¢â‚¬â„¢ÃƒÆ’Ã¢â‚¬Â ÃƒÂ¢Ã¢â€šÂ¬Ã¢â€žÂ¢ÃƒÆ’Ã†â€™ÃƒÂ¢Ã¢â€šÂ¬Ã‚Â ÃƒÆ’Ã‚Â¢ÃƒÂ¢Ã¢â‚¬Å¡Ã‚Â¬ÃƒÂ¢Ã¢â‚¬Å¾Ã‚Â¢ÃƒÆ’Ã†â€™Ãƒâ€ Ã¢â‚¬â„¢ÃƒÆ’Ã¢â‚¬Å¡Ãƒâ€šÃ‚Â¢ÃƒÆ’Ã†â€™Ãƒâ€šÃ‚Â¢ÃƒÆ’Ã‚Â¢ÃƒÂ¢Ã¢â‚¬Å¡Ã‚Â¬Ãƒâ€¦Ã‚Â¡ÃƒÆ’Ã¢â‚¬Å¡Ãƒâ€šÃ‚Â¬ÃƒÆ’Ã†â€™ÃƒÂ¢Ã¢â€šÂ¬Ã‚Â¦ÃƒÆ’Ã¢â‚¬Å¡Ãƒâ€šÃ‚Â¡ÃƒÆ’Ã†â€™Ãƒâ€ Ã¢â‚¬â„¢ÃƒÆ’Ã¢â‚¬Â ÃƒÂ¢Ã¢â€šÂ¬Ã¢â€žÂ¢ÃƒÆ’Ã†â€™Ãƒâ€šÃ‚Â¢ÃƒÆ’Ã‚Â¢ÃƒÂ¢Ã¢â€šÂ¬Ã…Â¡Ãƒâ€šÃ‚Â¬ÃƒÆ’Ã¢â‚¬Â¦Ãƒâ€šÃ‚Â¡ÃƒÆ’Ã†â€™Ãƒâ€ Ã¢â‚¬â„¢ÃƒÆ’Ã‚Â¢ÃƒÂ¢Ã¢â‚¬Å¡Ã‚Â¬Ãƒâ€¦Ã‚Â¡ÃƒÆ’Ã†â€™ÃƒÂ¢Ã¢â€šÂ¬Ã…Â¡ÃƒÆ’Ã¢â‚¬Å¡Ãƒâ€šÃ‚Â¼g</w:t>
       </w:r>
       <w:proofErr w:type="spellEnd"/>
       <w:r>
@@ -8932,7 +8932,7 @@
           <w:sz w:val="28"/>
           <w:szCs w:val="28"/>
         </w:rPr>
-        <w:t>ÃƒÆ’Ã†â€™Ãƒâ€ Ã¢â‚¬â„¢ÃƒÆ’Ã¢â‚¬Â ÃƒÂ¢Ã¢â€šÂ¬Ã¢â€žÂ¢ÃƒÆ’Ã†â€™ÃƒÂ¢Ã¢â€šÂ¬Ã‚Â ÃƒÆ’Ã‚Â¢ÃƒÂ¢Ã¢â‚¬Å¡Ã‚Â¬ÃƒÂ¢Ã¢â‚¬Å¾Ã‚Â¢ÃƒÆ’Ã†â€™Ãƒâ€ Ã¢â‚¬â„¢ÃƒÆ’Ã‚Â¢ÃƒÂ¢Ã¢â‚¬Å¡Ã‚Â¬Ãƒâ€šÃ‚Â¦ÃƒÆ’Ã†â€™ÃƒÂ¢Ã¢â€šÂ¬Ã…Â¡ÃƒÆ’Ã¢â‚¬Å¡Ãƒâ€šÃ‚Â½ÃƒÆ’Ã†â€™Ãƒâ€ Ã¢â‚¬â„¢ÃƒÆ’Ã¢â‚¬Â ÃƒÂ¢Ã¢â€šÂ¬Ã¢â€žÂ¢ÃƒÆ’Ã†â€™Ãƒâ€šÃ‚Â¢ÃƒÆ’Ã‚Â¢ÃƒÂ¢Ã¢â€šÂ¬Ã…Â¡Ãƒâ€šÃ‚Â¬ÃƒÆ’Ã¢â‚¬Â¦Ãƒâ€šÃ‚Â¡ÃƒÆ’Ã†â€™Ãƒâ€ Ã¢â‚¬â„¢ÃƒÆ’Ã‚Â¢ÃƒÂ¢Ã¢â‚¬Å¡Ã‚Â¬Ãƒâ€¦Ã‚Â¡ÃƒÆ’Ã†â€™ÃƒÂ¢Ã¢â€šÂ¬Ã…Â¡ÃƒÆ’Ã¢â‚¬Å¡Ãƒâ€šÃ‚Â¼g</w:t>
+        <w:t>ÃƒÆ’Ã†â€™Ãƒâ€ Ã¢â‚¬â„¢ÃƒÆ’Ã¢â‚¬Â ÃƒÂ¢Ã¢â€šÂ¬Ã¢â€žÂ¢ÃƒÆ’Ã†â€™ÃƒÂ¢Ã¢â€šÂ¬Ã‚Â ÃƒÆ’Ã‚Â¢ÃƒÂ¢Ã¢â‚¬Å¡Ã‚Â¬ÃƒÂ¢Ã¢â‚¬Å¾Ã‚Â¢ÃƒÆ’Ã†â€™Ãƒâ€ Ã¢â‚¬â„¢ÃƒÆ’Ã‚Â¢ÃƒÂ¢Ã¢â‚¬Å¡Ã‚Â¬Ãƒâ€šÃ‚Â ÃƒÆ’Ã†â€™Ãƒâ€šÃ‚Â¢ÃƒÆ’Ã‚Â¢ÃƒÂ¢Ã¢â€šÂ¬Ã…Â¡Ãƒâ€šÃ‚Â¬ÃƒÆ’Ã‚Â¢ÃƒÂ¢Ã¢â€šÂ¬Ã…Â¾Ãƒâ€šÃ‚Â¢ÃƒÆ’Ã†â€™Ãƒâ€ Ã¢â‚¬â„¢ÃƒÆ’Ã¢â‚¬Â ÃƒÂ¢Ã¢â€šÂ¬Ã¢â€žÂ¢ÃƒÆ’Ã†â€™Ãƒâ€šÃ‚Â¢ÃƒÆ’Ã‚Â¢ÃƒÂ¢Ã¢â€šÂ¬Ã…Â¡Ãƒâ€šÃ‚Â¬ÃƒÆ’Ã¢â‚¬Å¡Ãƒâ€šÃ‚Â ÃƒÆ’Ã†â€™Ãƒâ€ Ã¢â‚¬â„¢ÃƒÆ’Ã¢â‚¬Å¡Ãƒâ€šÃ‚Â¢ÃƒÆ’Ã†â€™Ãƒâ€šÃ‚Â¢ÃƒÆ’Ã‚Â¢ÃƒÂ¢Ã¢â‚¬Å¡Ã‚Â¬Ãƒâ€¦Ã‚Â¡ÃƒÆ’Ã¢â‚¬Å¡Ãƒâ€šÃ‚Â¬ÃƒÆ’Ã†â€™Ãƒâ€šÃ‚Â¢ÃƒÆ’Ã‚Â¢ÃƒÂ¢Ã¢â‚¬Å¡Ã‚Â¬Ãƒâ€¦Ã‚Â¾ÃƒÆ’Ã¢â‚¬Å¡Ãƒâ€šÃ‚Â¢ÃƒÆ’Ã†â€™Ãƒâ€ Ã¢â‚¬â„¢ÃƒÆ’Ã¢â‚¬Â ÃƒÂ¢Ã¢â€šÂ¬Ã¢â€žÂ¢ÃƒÆ’Ã†â€™ÃƒÂ¢Ã¢â€šÂ¬Ã‚Â ÃƒÆ’Ã‚Â¢ÃƒÂ¢Ã¢â‚¬Å¡Ã‚Â¬ÃƒÂ¢Ã¢â‚¬Å¾Ã‚Â¢ÃƒÆ’Ã†â€™Ãƒâ€ Ã¢â‚¬â„¢ÃƒÆ’Ã¢â‚¬Å¡Ãƒâ€šÃ‚Â¢ÃƒÆ’Ã†â€™Ãƒâ€šÃ‚Â¢ÃƒÆ’Ã‚Â¢ÃƒÂ¢Ã¢â‚¬Å¡Ã‚Â¬Ãƒâ€¦Ã‚Â¡ÃƒÆ’Ã¢â‚¬Å¡Ãƒâ€šÃ‚Â¬ÃƒÆ’Ã†â€™ÃƒÂ¢Ã¢â€šÂ¬Ã…Â¡ÃƒÆ’Ã¢â‚¬Å¡Ãƒâ€šÃ‚Â¦ÃƒÆ’Ã†â€™Ãƒâ€ Ã¢â‚¬â„¢ÃƒÆ’Ã¢â‚¬Â ÃƒÂ¢Ã¢â€šÂ¬Ã¢â€žÂ¢ÃƒÆ’Ã†â€™Ãƒâ€šÃ‚Â¢ÃƒÆ’Ã‚Â¢ÃƒÂ¢Ã¢â€šÂ¬Ã…Â¡Ãƒâ€šÃ‚Â¬ÃƒÆ’Ã¢â‚¬Â¦Ãƒâ€šÃ‚Â¡ÃƒÆ’Ã†â€™Ãƒâ€ Ã¢â‚¬â„¢ÃƒÆ’Ã‚Â¢ÃƒÂ¢Ã¢â‚¬Å¡Ã‚Â¬Ãƒâ€¦Ã‚Â¡ÃƒÆ’Ã†â€™ÃƒÂ¢Ã¢â€šÂ¬Ã…Â¡ÃƒÆ’Ã¢â‚¬Å¡Ãƒâ€šÃ‚Â½ÃƒÆ’Ã†â€™Ãƒâ€ Ã¢â‚¬â„¢ÃƒÆ’Ã¢â‚¬Â ÃƒÂ¢Ã¢â€šÂ¬Ã¢â€žÂ¢ÃƒÆ’Ã†â€™ÃƒÂ¢Ã¢â€šÂ¬Ã‚Â ÃƒÆ’Ã‚Â¢ÃƒÂ¢Ã¢â‚¬Å¡Ã‚Â¬ÃƒÂ¢Ã¢â‚¬Å¾Ã‚Â¢ÃƒÆ’Ã†â€™Ãƒâ€ Ã¢â‚¬â„¢ÃƒÆ’Ã‚Â¢ÃƒÂ¢Ã¢â‚¬Å¡Ã‚Â¬Ãƒâ€šÃ‚Â ÃƒÆ’Ã†â€™Ãƒâ€šÃ‚Â¢ÃƒÆ’Ã‚Â¢ÃƒÂ¢Ã¢â€šÂ¬Ã…Â¡Ãƒâ€šÃ‚Â¬ÃƒÆ’Ã‚Â¢ÃƒÂ¢Ã¢â€šÂ¬Ã…Â¾Ãƒâ€šÃ‚Â¢ÃƒÆ’Ã†â€™Ãƒâ€ Ã¢â‚¬â„¢ÃƒÆ’Ã¢â‚¬Â ÃƒÂ¢Ã¢â€šÂ¬Ã¢â€žÂ¢ÃƒÆ’Ã†â€™ÃƒÂ¢Ã¢â€šÂ¬Ã…Â¡ÃƒÆ’Ã¢â‚¬Å¡Ãƒâ€šÃ‚Â¢ÃƒÆ’Ã†â€™Ãƒâ€ Ã¢â‚¬â„¢ÃƒÆ’Ã¢â‚¬Å¡Ãƒâ€šÃ‚Â¢ÃƒÆ’Ã†â€™Ãƒâ€šÃ‚Â¢ÃƒÆ’Ã‚Â¢ÃƒÂ¢Ã¢â€šÂ¬Ã…Â¡Ãƒâ€šÃ‚Â¬ÃƒÆ’Ã¢â‚¬Â¦Ãƒâ€šÃ‚Â¡ÃƒÆ’Ã†â€™ÃƒÂ¢Ã¢â€šÂ¬Ã…Â¡ÃƒÆ’Ã¢â‚¬Å¡Ãƒâ€šÃ‚Â¬ÃƒÆ’Ã†â€™Ãƒâ€ Ã¢â‚¬â„¢ÃƒÆ’Ã‚Â¢ÃƒÂ¢Ã¢â‚¬Å¡Ã‚Â¬Ãƒâ€šÃ‚Â¦ÃƒÆ’Ã†â€™ÃƒÂ¢Ã¢â€šÂ¬Ã…Â¡ÃƒÆ’Ã¢â‚¬Å¡Ãƒâ€šÃ‚Â¡ÃƒÆ’Ã†â€™Ãƒâ€ Ã¢â‚¬â„¢ÃƒÆ’Ã¢â‚¬Â ÃƒÂ¢Ã¢â€šÂ¬Ã¢â€žÂ¢ÃƒÆ’Ã†â€™ÃƒÂ¢Ã¢â€šÂ¬Ã‚Â ÃƒÆ’Ã‚Â¢ÃƒÂ¢Ã¢â‚¬Å¡Ã‚Â¬ÃƒÂ¢Ã¢â‚¬Å¾Ã‚Â¢ÃƒÆ’Ã†â€™Ãƒâ€ Ã¢â‚¬â„¢ÃƒÆ’Ã¢â‚¬Å¡Ãƒâ€šÃ‚Â¢ÃƒÆ’Ã†â€™Ãƒâ€šÃ‚Â¢ÃƒÆ’Ã‚Â¢ÃƒÂ¢Ã¢â‚¬Å¡Ã‚Â¬Ãƒâ€¦Ã‚Â¡ÃƒÆ’Ã¢â‚¬Å¡Ãƒâ€šÃ‚Â¬ÃƒÆ’Ã†â€™ÃƒÂ¢Ã¢â€šÂ¬Ã‚Â¦ÃƒÆ’Ã¢â‚¬Å¡Ãƒâ€šÃ‚Â¡ÃƒÆ’Ã†â€™Ãƒâ€ Ã¢â‚¬â„¢ÃƒÆ’Ã¢â‚¬Â ÃƒÂ¢Ã¢â€šÂ¬Ã¢â€žÂ¢ÃƒÆ’Ã†â€™Ãƒâ€šÃ‚Â¢ÃƒÆ’Ã‚Â¢ÃƒÂ¢Ã¢â€šÂ¬Ã…Â¡Ãƒâ€šÃ‚Â¬ÃƒÆ’Ã¢â‚¬Â¦Ãƒâ€šÃ‚Â¡ÃƒÆ’Ã†â€™Ãƒâ€ Ã¢â‚¬â„¢ÃƒÆ’Ã‚Â¢ÃƒÂ¢Ã¢â‚¬Å¡Ã‚Â¬Ãƒâ€¦Ã‚Â¡ÃƒÆ’Ã†â€™ÃƒÂ¢Ã¢â€šÂ¬Ã…Â¡ÃƒÆ’Ã¢â‚¬Å¡Ãƒâ€šÃ‚Â¼g</w:t>
       </w:r>
       <w:proofErr w:type="spellEnd"/>
       <w:r>
@@ -8959,7 +8959,7 @@
           <w:sz w:val="28"/>
           <w:szCs w:val="28"/>
         </w:rPr>
-        <w:t>ÃƒÆ’Ã†â€™Ãƒâ€ Ã¢â‚¬â„¢ÃƒÆ’Ã¢â‚¬Â ÃƒÂ¢Ã¢â€šÂ¬Ã¢â€žÂ¢ÃƒÆ’Ã†â€™ÃƒÂ¢Ã¢â€šÂ¬Ã‚Â ÃƒÆ’Ã‚Â¢ÃƒÂ¢Ã¢â‚¬Å¡Ã‚Â¬ÃƒÂ¢Ã¢â‚¬Å¾Ã‚Â¢ÃƒÆ’Ã†â€™Ãƒâ€ Ã¢â‚¬â„¢ÃƒÆ’Ã‚Â¢ÃƒÂ¢Ã¢â‚¬Å¡Ã‚Â¬Ãƒâ€šÃ‚Â¦ÃƒÆ’Ã†â€™ÃƒÂ¢Ã¢â€šÂ¬Ã…Â¡ÃƒÆ’Ã¢â‚¬Å¡Ãƒâ€šÃ‚Â½ÃƒÆ’Ã†â€™Ãƒâ€ Ã¢â‚¬â„¢ÃƒÆ’Ã¢â‚¬Â ÃƒÂ¢Ã¢â€šÂ¬Ã¢â€žÂ¢ÃƒÆ’Ã†â€™Ãƒâ€šÃ‚Â¢ÃƒÆ’Ã‚Â¢ÃƒÂ¢Ã¢â€šÂ¬Ã…Â¡Ãƒâ€šÃ‚Â¬ÃƒÆ’Ã¢â‚¬Â¦Ãƒâ€šÃ‚Â¡ÃƒÆ’Ã†â€™Ãƒâ€ Ã¢â‚¬â„¢ÃƒÆ’Ã‚Â¢ÃƒÂ¢Ã¢â‚¬Å¡Ã‚Â¬Ãƒâ€¦Ã‚Â¡ÃƒÆ’Ã†â€™ÃƒÂ¢Ã¢â€šÂ¬Ã…Â¡ÃƒÆ’Ã¢â‚¬Å¡Ãƒâ€šÃ‚Â¼g</w:t>
+        <w:t>ÃƒÆ’Ã†â€™Ãƒâ€ Ã¢â‚¬â„¢ÃƒÆ’Ã¢â‚¬Â ÃƒÂ¢Ã¢â€šÂ¬Ã¢â€žÂ¢ÃƒÆ’Ã†â€™ÃƒÂ¢Ã¢â€šÂ¬Ã‚Â ÃƒÆ’Ã‚Â¢ÃƒÂ¢Ã¢â‚¬Å¡Ã‚Â¬ÃƒÂ¢Ã¢â‚¬Å¾Ã‚Â¢ÃƒÆ’Ã†â€™Ãƒâ€ Ã¢â‚¬â„¢ÃƒÆ’Ã‚Â¢ÃƒÂ¢Ã¢â‚¬Å¡Ã‚Â¬Ãƒâ€šÃ‚Â ÃƒÆ’Ã†â€™Ãƒâ€šÃ‚Â¢ÃƒÆ’Ã‚Â¢ÃƒÂ¢Ã¢â€šÂ¬Ã…Â¡Ãƒâ€šÃ‚Â¬ÃƒÆ’Ã‚Â¢ÃƒÂ¢Ã¢â€šÂ¬Ã…Â¾Ãƒâ€šÃ‚Â¢ÃƒÆ’Ã†â€™Ãƒâ€ Ã¢â‚¬â„¢ÃƒÆ’Ã¢â‚¬Â ÃƒÂ¢Ã¢â€šÂ¬Ã¢â€žÂ¢ÃƒÆ’Ã†â€™Ãƒâ€šÃ‚Â¢ÃƒÆ’Ã‚Â¢ÃƒÂ¢Ã¢â€šÂ¬Ã…Â¡Ãƒâ€šÃ‚Â¬ÃƒÆ’Ã¢â‚¬Å¡Ãƒâ€šÃ‚Â ÃƒÆ’Ã†â€™Ãƒâ€ Ã¢â‚¬â„¢ÃƒÆ’Ã¢â‚¬Å¡Ãƒâ€šÃ‚Â¢ÃƒÆ’Ã†â€™Ãƒâ€šÃ‚Â¢ÃƒÆ’Ã‚Â¢ÃƒÂ¢Ã¢â‚¬Å¡Ã‚Â¬Ãƒâ€¦Ã‚Â¡ÃƒÆ’Ã¢â‚¬Å¡Ãƒâ€šÃ‚Â¬ÃƒÆ’Ã†â€™Ãƒâ€šÃ‚Â¢ÃƒÆ’Ã‚Â¢ÃƒÂ¢Ã¢â‚¬Å¡Ã‚Â¬Ãƒâ€¦Ã‚Â¾ÃƒÆ’Ã¢â‚¬Å¡Ãƒâ€šÃ‚Â¢ÃƒÆ’Ã†â€™Ãƒâ€ Ã¢â‚¬â„¢ÃƒÆ’Ã¢â‚¬Â ÃƒÂ¢Ã¢â€šÂ¬Ã¢â€žÂ¢ÃƒÆ’Ã†â€™ÃƒÂ¢Ã¢â€šÂ¬Ã‚Â ÃƒÆ’Ã‚Â¢ÃƒÂ¢Ã¢â‚¬Å¡Ã‚Â¬ÃƒÂ¢Ã¢â‚¬Å¾Ã‚Â¢ÃƒÆ’Ã†â€™Ãƒâ€ Ã¢â‚¬â„¢ÃƒÆ’Ã¢â‚¬Å¡Ãƒâ€šÃ‚Â¢ÃƒÆ’Ã†â€™Ãƒâ€šÃ‚Â¢ÃƒÆ’Ã‚Â¢ÃƒÂ¢Ã¢â‚¬Å¡Ã‚Â¬Ãƒâ€¦Ã‚Â¡ÃƒÆ’Ã¢â‚¬Å¡Ãƒâ€šÃ‚Â¬ÃƒÆ’Ã†â€™ÃƒÂ¢Ã¢â€šÂ¬Ã…Â¡ÃƒÆ’Ã¢â‚¬Å¡Ãƒâ€šÃ‚Â¦ÃƒÆ’Ã†â€™Ãƒâ€ Ã¢â‚¬â„¢ÃƒÆ’Ã¢â‚¬Â ÃƒÂ¢Ã¢â€šÂ¬Ã¢â€žÂ¢ÃƒÆ’Ã†â€™Ãƒâ€šÃ‚Â¢ÃƒÆ’Ã‚Â¢ÃƒÂ¢Ã¢â€šÂ¬Ã…Â¡Ãƒâ€šÃ‚Â¬ÃƒÆ’Ã¢â‚¬Â¦Ãƒâ€šÃ‚Â¡ÃƒÆ’Ã†â€™Ãƒâ€ Ã¢â‚¬â„¢ÃƒÆ’Ã‚Â¢ÃƒÂ¢Ã¢â‚¬Å¡Ã‚Â¬Ãƒâ€¦Ã‚Â¡ÃƒÆ’Ã†â€™ÃƒÂ¢Ã¢â€šÂ¬Ã…Â¡ÃƒÆ’Ã¢â‚¬Å¡Ãƒâ€šÃ‚Â½ÃƒÆ’Ã†â€™Ãƒâ€ Ã¢â‚¬â„¢ÃƒÆ’Ã¢â‚¬Â ÃƒÂ¢Ã¢â€šÂ¬Ã¢â€žÂ¢ÃƒÆ’Ã†â€™ÃƒÂ¢Ã¢â€šÂ¬Ã‚Â ÃƒÆ’Ã‚Â¢ÃƒÂ¢Ã¢â‚¬Å¡Ã‚Â¬ÃƒÂ¢Ã¢â‚¬Å¾Ã‚Â¢ÃƒÆ’Ã†â€™Ãƒâ€ Ã¢â‚¬â„¢ÃƒÆ’Ã‚Â¢ÃƒÂ¢Ã¢â‚¬Å¡Ã‚Â¬Ãƒâ€šÃ‚Â ÃƒÆ’Ã†â€™Ãƒâ€šÃ‚Â¢ÃƒÆ’Ã‚Â¢ÃƒÂ¢Ã¢â€šÂ¬Ã…Â¡Ãƒâ€šÃ‚Â¬ÃƒÆ’Ã‚Â¢ÃƒÂ¢Ã¢â€šÂ¬Ã…Â¾Ãƒâ€šÃ‚Â¢ÃƒÆ’Ã†â€™Ãƒâ€ Ã¢â‚¬â„¢ÃƒÆ’Ã¢â‚¬Â ÃƒÂ¢Ã¢â€šÂ¬Ã¢â€žÂ¢ÃƒÆ’Ã†â€™ÃƒÂ¢Ã¢â€šÂ¬Ã…Â¡ÃƒÆ’Ã¢â‚¬Å¡Ãƒâ€šÃ‚Â¢ÃƒÆ’Ã†â€™Ãƒâ€ Ã¢â‚¬â„¢ÃƒÆ’Ã¢â‚¬Å¡Ãƒâ€šÃ‚Â¢ÃƒÆ’Ã†â€™Ãƒâ€šÃ‚Â¢ÃƒÆ’Ã‚Â¢ÃƒÂ¢Ã¢â€šÂ¬Ã…Â¡Ãƒâ€šÃ‚Â¬ÃƒÆ’Ã¢â‚¬Â¦Ãƒâ€šÃ‚Â¡ÃƒÆ’Ã†â€™ÃƒÂ¢Ã¢â€šÂ¬Ã…Â¡ÃƒÆ’Ã¢â‚¬Å¡Ãƒâ€šÃ‚Â¬ÃƒÆ’Ã†â€™Ãƒâ€ Ã¢â‚¬â„¢ÃƒÆ’Ã‚Â¢ÃƒÂ¢Ã¢â‚¬Å¡Ã‚Â¬Ãƒâ€šÃ‚Â¦ÃƒÆ’Ã†â€™ÃƒÂ¢Ã¢â€šÂ¬Ã…Â¡ÃƒÆ’Ã¢â‚¬Å¡Ãƒâ€šÃ‚Â¡ÃƒÆ’Ã†â€™Ãƒâ€ Ã¢â‚¬â„¢ÃƒÆ’Ã¢â‚¬Â ÃƒÂ¢Ã¢â€šÂ¬Ã¢â€žÂ¢ÃƒÆ’Ã†â€™ÃƒÂ¢Ã¢â€šÂ¬Ã‚Â ÃƒÆ’Ã‚Â¢ÃƒÂ¢Ã¢â‚¬Å¡Ã‚Â¬ÃƒÂ¢Ã¢â‚¬Å¾Ã‚Â¢ÃƒÆ’Ã†â€™Ãƒâ€ Ã¢â‚¬â„¢ÃƒÆ’Ã¢â‚¬Å¡Ãƒâ€šÃ‚Â¢ÃƒÆ’Ã†â€™Ãƒâ€šÃ‚Â¢ÃƒÆ’Ã‚Â¢ÃƒÂ¢Ã¢â‚¬Å¡Ã‚Â¬Ãƒâ€¦Ã‚Â¡ÃƒÆ’Ã¢â‚¬Å¡Ãƒâ€šÃ‚Â¬ÃƒÆ’Ã†â€™ÃƒÂ¢Ã¢â€šÂ¬Ã‚Â¦ÃƒÆ’Ã¢â‚¬Å¡Ãƒâ€šÃ‚Â¡ÃƒÆ’Ã†â€™Ãƒâ€ Ã¢â‚¬â„¢ÃƒÆ’Ã¢â‚¬Â ÃƒÂ¢Ã¢â€šÂ¬Ã¢â€žÂ¢ÃƒÆ’Ã†â€™Ãƒâ€šÃ‚Â¢ÃƒÆ’Ã‚Â¢ÃƒÂ¢Ã¢â€šÂ¬Ã…Â¡Ãƒâ€šÃ‚Â¬ÃƒÆ’Ã¢â‚¬Â¦Ãƒâ€šÃ‚Â¡ÃƒÆ’Ã†â€™Ãƒâ€ Ã¢â‚¬â„¢ÃƒÆ’Ã‚Â¢ÃƒÂ¢Ã¢â‚¬Å¡Ã‚Â¬Ãƒâ€¦Ã‚Â¡ÃƒÆ’Ã†â€™ÃƒÂ¢Ã¢â€šÂ¬Ã…Â¡ÃƒÆ’Ã¢â‚¬Å¡Ãƒâ€šÃ‚Â¼g</w:t>
       </w:r>
       <w:proofErr w:type="spellEnd"/>
       <w:r>
@@ -8977,7 +8977,7 @@
           <w:sz w:val="28"/>
           <w:szCs w:val="28"/>
         </w:rPr>
-        <w:t>ÃƒÆ’Ã†â€™Ãƒâ€ Ã¢â‚¬â„¢ÃƒÆ’Ã¢â‚¬Â ÃƒÂ¢Ã¢â€šÂ¬Ã¢â€žÂ¢ÃƒÆ’Ã†â€™ÃƒÂ¢Ã¢â€šÂ¬Ã‚Â ÃƒÆ’Ã‚Â¢ÃƒÂ¢Ã¢â‚¬Å¡Ã‚Â¬ÃƒÂ¢Ã¢â‚¬Å¾Ã‚Â¢ÃƒÆ’Ã†â€™Ãƒâ€ Ã¢â‚¬â„¢ÃƒÆ’Ã‚Â¢ÃƒÂ¢Ã¢â‚¬Å¡Ã‚Â¬Ãƒâ€šÃ‚Â¦ÃƒÆ’Ã†â€™ÃƒÂ¢Ã¢â€šÂ¬Ã…Â¡ÃƒÆ’Ã¢â‚¬Å¡Ãƒâ€šÃ‚Â½ÃƒÆ’Ã†â€™Ãƒâ€ Ã¢â‚¬â„¢ÃƒÆ’Ã¢â‚¬Â ÃƒÂ¢Ã¢â€šÂ¬Ã¢â€žÂ¢ÃƒÆ’Ã†â€™Ãƒâ€šÃ‚Â¢ÃƒÆ’Ã‚Â¢ÃƒÂ¢Ã¢â€šÂ¬Ã…Â¡Ãƒâ€šÃ‚Â¬ÃƒÆ’Ã¢â‚¬Â¦Ãƒâ€šÃ‚Â¡ÃƒÆ’Ã†â€™Ãƒâ€ Ã¢â‚¬â„¢ÃƒÆ’Ã‚Â¢ÃƒÂ¢Ã¢â‚¬Å¡Ã‚Â¬Ãƒâ€¦Ã‚Â¡ÃƒÆ’Ã†â€™ÃƒÂ¢Ã¢â€šÂ¬Ã…Â¡ÃƒÆ’Ã¢â‚¬Å¡Ãƒâ€šÃ‚Â¼g</w:t>
+        <w:t>ÃƒÆ’Ã†â€™Ãƒâ€ Ã¢â‚¬â„¢ÃƒÆ’Ã¢â‚¬Â ÃƒÂ¢Ã¢â€šÂ¬Ã¢â€žÂ¢ÃƒÆ’Ã†â€™ÃƒÂ¢Ã¢â€šÂ¬Ã‚Â ÃƒÆ’Ã‚Â¢ÃƒÂ¢Ã¢â‚¬Å¡Ã‚Â¬ÃƒÂ¢Ã¢â‚¬Å¾Ã‚Â¢ÃƒÆ’Ã†â€™Ãƒâ€ Ã¢â‚¬â„¢ÃƒÆ’Ã‚Â¢ÃƒÂ¢Ã¢â‚¬Å¡Ã‚Â¬Ãƒâ€šÃ‚Â ÃƒÆ’Ã†â€™Ãƒâ€šÃ‚Â¢ÃƒÆ’Ã‚Â¢ÃƒÂ¢Ã¢â€šÂ¬Ã…Â¡Ãƒâ€šÃ‚Â¬ÃƒÆ’Ã‚Â¢ÃƒÂ¢Ã¢â€šÂ¬Ã…Â¾Ãƒâ€šÃ‚Â¢ÃƒÆ’Ã†â€™Ãƒâ€ Ã¢â‚¬â„¢ÃƒÆ’Ã¢â‚¬Â ÃƒÂ¢Ã¢â€šÂ¬Ã¢â€žÂ¢ÃƒÆ’Ã†â€™Ãƒâ€šÃ‚Â¢ÃƒÆ’Ã‚Â¢ÃƒÂ¢Ã¢â€šÂ¬Ã…Â¡Ãƒâ€šÃ‚Â¬ÃƒÆ’Ã¢â‚¬Å¡Ãƒâ€šÃ‚Â ÃƒÆ’Ã†â€™Ãƒâ€ Ã¢â‚¬â„¢ÃƒÆ’Ã¢â‚¬Å¡Ãƒâ€šÃ‚Â¢ÃƒÆ’Ã†â€™Ãƒâ€šÃ‚Â¢ÃƒÆ’Ã‚Â¢ÃƒÂ¢Ã¢â‚¬Å¡Ã‚Â¬Ãƒâ€¦Ã‚Â¡ÃƒÆ’Ã¢â‚¬Å¡Ãƒâ€šÃ‚Â¬ÃƒÆ’Ã†â€™Ãƒâ€šÃ‚Â¢ÃƒÆ’Ã‚Â¢ÃƒÂ¢Ã¢â‚¬Å¡Ã‚Â¬Ãƒâ€¦Ã‚Â¾ÃƒÆ’Ã¢â‚¬Å¡Ãƒâ€šÃ‚Â¢ÃƒÆ’Ã†â€™Ãƒâ€ Ã¢â‚¬â„¢ÃƒÆ’Ã¢â‚¬Â ÃƒÂ¢Ã¢â€šÂ¬Ã¢â€žÂ¢ÃƒÆ’Ã†â€™ÃƒÂ¢Ã¢â€šÂ¬Ã‚Â ÃƒÆ’Ã‚Â¢ÃƒÂ¢Ã¢â‚¬Å¡Ã‚Â¬ÃƒÂ¢Ã¢â‚¬Å¾Ã‚Â¢ÃƒÆ’Ã†â€™Ãƒâ€ Ã¢â‚¬â„¢ÃƒÆ’Ã¢â‚¬Å¡Ãƒâ€šÃ‚Â¢ÃƒÆ’Ã†â€™Ãƒâ€šÃ‚Â¢ÃƒÆ’Ã‚Â¢ÃƒÂ¢Ã¢â‚¬Å¡Ã‚Â¬Ãƒâ€¦Ã‚Â¡ÃƒÆ’Ã¢â‚¬Å¡Ãƒâ€šÃ‚Â¬ÃƒÆ’Ã†â€™ÃƒÂ¢Ã¢â€šÂ¬Ã…Â¡ÃƒÆ’Ã¢â‚¬Å¡Ãƒâ€šÃ‚Â¦ÃƒÆ’Ã†â€™Ãƒâ€ Ã¢â‚¬â„¢ÃƒÆ’Ã¢â‚¬Â ÃƒÂ¢Ã¢â€šÂ¬Ã¢â€žÂ¢ÃƒÆ’Ã†â€™Ãƒâ€šÃ‚Â¢ÃƒÆ’Ã‚Â¢ÃƒÂ¢Ã¢â€šÂ¬Ã…Â¡Ãƒâ€šÃ‚Â¬ÃƒÆ’Ã¢â‚¬Â¦Ãƒâ€šÃ‚Â¡ÃƒÆ’Ã†â€™Ãƒâ€ Ã¢â‚¬â„¢ÃƒÆ’Ã‚Â¢ÃƒÂ¢Ã¢â‚¬Å¡Ã‚Â¬Ãƒâ€¦Ã‚Â¡ÃƒÆ’Ã†â€™ÃƒÂ¢Ã¢â€šÂ¬Ã…Â¡ÃƒÆ’Ã¢â‚¬Å¡Ãƒâ€šÃ‚Â½ÃƒÆ’Ã†â€™Ãƒâ€ Ã¢â‚¬â„¢ÃƒÆ’Ã¢â‚¬Â ÃƒÂ¢Ã¢â€šÂ¬Ã¢â€žÂ¢ÃƒÆ’Ã†â€™ÃƒÂ¢Ã¢â€šÂ¬Ã‚Â ÃƒÆ’Ã‚Â¢ÃƒÂ¢Ã¢â‚¬Å¡Ã‚Â¬ÃƒÂ¢Ã¢â‚¬Å¾Ã‚Â¢ÃƒÆ’Ã†â€™Ãƒâ€ Ã¢â‚¬â„¢ÃƒÆ’Ã‚Â¢ÃƒÂ¢Ã¢â‚¬Å¡Ã‚Â¬Ãƒâ€šÃ‚Â ÃƒÆ’Ã†â€™Ãƒâ€šÃ‚Â¢ÃƒÆ’Ã‚Â¢ÃƒÂ¢Ã¢â€šÂ¬Ã…Â¡Ãƒâ€šÃ‚Â¬ÃƒÆ’Ã‚Â¢ÃƒÂ¢Ã¢â€šÂ¬Ã…Â¾Ãƒâ€šÃ‚Â¢ÃƒÆ’Ã†â€™Ãƒâ€ Ã¢â‚¬â„¢ÃƒÆ’Ã¢â‚¬Â ÃƒÂ¢Ã¢â€šÂ¬Ã¢â€žÂ¢ÃƒÆ’Ã†â€™ÃƒÂ¢Ã¢â€šÂ¬Ã…Â¡ÃƒÆ’Ã¢â‚¬Å¡Ãƒâ€šÃ‚Â¢ÃƒÆ’Ã†â€™Ãƒâ€ Ã¢â‚¬â„¢ÃƒÆ’Ã¢â‚¬Å¡Ãƒâ€šÃ‚Â¢ÃƒÆ’Ã†â€™Ãƒâ€šÃ‚Â¢ÃƒÆ’Ã‚Â¢ÃƒÂ¢Ã¢â€šÂ¬Ã…Â¡Ãƒâ€šÃ‚Â¬ÃƒÆ’Ã¢â‚¬Â¦Ãƒâ€šÃ‚Â¡ÃƒÆ’Ã†â€™ÃƒÂ¢Ã¢â€šÂ¬Ã…Â¡ÃƒÆ’Ã¢â‚¬Å¡Ãƒâ€šÃ‚Â¬ÃƒÆ’Ã†â€™Ãƒâ€ Ã¢â‚¬â„¢ÃƒÆ’Ã‚Â¢ÃƒÂ¢Ã¢â‚¬Å¡Ã‚Â¬Ãƒâ€šÃ‚Â¦ÃƒÆ’Ã†â€™ÃƒÂ¢Ã¢â€šÂ¬Ã…Â¡ÃƒÆ’Ã¢â‚¬Å¡Ãƒâ€šÃ‚Â¡ÃƒÆ’Ã†â€™Ãƒâ€ Ã¢â‚¬â„¢ÃƒÆ’Ã¢â‚¬Â ÃƒÂ¢Ã¢â€šÂ¬Ã¢â€žÂ¢ÃƒÆ’Ã†â€™ÃƒÂ¢Ã¢â€šÂ¬Ã‚Â ÃƒÆ’Ã‚Â¢ÃƒÂ¢Ã¢â‚¬Å¡Ã‚Â¬ÃƒÂ¢Ã¢â‚¬Å¾Ã‚Â¢ÃƒÆ’Ã†â€™Ãƒâ€ Ã¢â‚¬â„¢ÃƒÆ’Ã¢â‚¬Å¡Ãƒâ€šÃ‚Â¢ÃƒÆ’Ã†â€™Ãƒâ€šÃ‚Â¢ÃƒÆ’Ã‚Â¢ÃƒÂ¢Ã¢â‚¬Å¡Ã‚Â¬Ãƒâ€¦Ã‚Â¡ÃƒÆ’Ã¢â‚¬Å¡Ãƒâ€šÃ‚Â¬ÃƒÆ’Ã†â€™ÃƒÂ¢Ã¢â€šÂ¬Ã‚Â¦ÃƒÆ’Ã¢â‚¬Å¡Ãƒâ€šÃ‚Â¡ÃƒÆ’Ã†â€™Ãƒâ€ Ã¢â‚¬â„¢ÃƒÆ’Ã¢â‚¬Â ÃƒÂ¢Ã¢â€šÂ¬Ã¢â€žÂ¢ÃƒÆ’Ã†â€™Ãƒâ€šÃ‚Â¢ÃƒÆ’Ã‚Â¢ÃƒÂ¢Ã¢â€šÂ¬Ã…Â¡Ãƒâ€šÃ‚Â¬ÃƒÆ’Ã¢â‚¬Â¦Ãƒâ€šÃ‚Â¡ÃƒÆ’Ã†â€™Ãƒâ€ Ã¢â‚¬â„¢ÃƒÆ’Ã‚Â¢ÃƒÂ¢Ã¢â‚¬Å¡Ã‚Â¬Ãƒâ€¦Ã‚Â¡ÃƒÆ’Ã†â€™ÃƒÂ¢Ã¢â€šÂ¬Ã…Â¡ÃƒÆ’Ã¢â‚¬Å¡Ãƒâ€šÃ‚Â¼g</w:t>
       </w:r>
       <w:proofErr w:type="spellEnd"/>
       <w:r>
@@ -9134,7 +9134,7 @@
           <w:sz w:val="28"/>
           <w:szCs w:val="28"/>
         </w:rPr>
-        <w:t>ÃƒÆ’Ã†â€™Ãƒâ€ Ã¢â‚¬â„¢ÃƒÆ’Ã¢â‚¬Â ÃƒÂ¢Ã¢â€šÂ¬Ã¢â€žÂ¢ÃƒÆ’Ã†â€™ÃƒÂ¢Ã¢â€šÂ¬Ã‚Â ÃƒÆ’Ã‚Â¢ÃƒÂ¢Ã¢â‚¬Å¡Ã‚Â¬ÃƒÂ¢Ã¢â‚¬Å¾Ã‚Â¢ÃƒÆ’Ã†â€™Ãƒâ€ Ã¢â‚¬â„¢ÃƒÆ’Ã‚Â¢ÃƒÂ¢Ã¢â‚¬Å¡Ã‚Â¬Ãƒâ€šÃ‚Â¦ÃƒÆ’Ã†â€™ÃƒÂ¢Ã¢â€šÂ¬Ã…Â¡ÃƒÆ’Ã¢â‚¬Å¡Ãƒâ€šÃ‚Â½ÃƒÆ’Ã†â€™Ãƒâ€ Ã¢â‚¬â„¢ÃƒÆ’Ã¢â‚¬Â ÃƒÂ¢Ã¢â€šÂ¬Ã¢â€žÂ¢ÃƒÆ’Ã†â€™Ãƒâ€šÃ‚Â¢ÃƒÆ’Ã‚Â¢ÃƒÂ¢Ã¢â€šÂ¬Ã…Â¡Ãƒâ€šÃ‚Â¬ÃƒÆ’Ã¢â‚¬Â¦Ãƒâ€šÃ‚Â¡ÃƒÆ’Ã†â€™Ãƒâ€ Ã¢â‚¬â„¢ÃƒÆ’Ã‚Â¢ÃƒÂ¢Ã¢â‚¬Å¡Ã‚Â¬Ãƒâ€¦Ã‚Â¡ÃƒÆ’Ã†â€™ÃƒÂ¢Ã¢â€šÂ¬Ã…Â¡ÃƒÆ’Ã¢â‚¬Å¡Ãƒâ€šÃ‚Â¼g</w:t>
+        <w:t>ÃƒÆ’Ã†â€™Ãƒâ€ Ã¢â‚¬â„¢ÃƒÆ’Ã¢â‚¬Â ÃƒÂ¢Ã¢â€šÂ¬Ã¢â€žÂ¢ÃƒÆ’Ã†â€™ÃƒÂ¢Ã¢â€šÂ¬Ã‚Â ÃƒÆ’Ã‚Â¢ÃƒÂ¢Ã¢â‚¬Å¡Ã‚Â¬ÃƒÂ¢Ã¢â‚¬Å¾Ã‚Â¢ÃƒÆ’Ã†â€™Ãƒâ€ Ã¢â‚¬â„¢ÃƒÆ’Ã‚Â¢ÃƒÂ¢Ã¢â‚¬Å¡Ã‚Â¬Ãƒâ€šÃ‚Â ÃƒÆ’Ã†â€™Ãƒâ€šÃ‚Â¢ÃƒÆ’Ã‚Â¢ÃƒÂ¢Ã¢â€šÂ¬Ã…Â¡Ãƒâ€šÃ‚Â¬ÃƒÆ’Ã‚Â¢ÃƒÂ¢Ã¢â€šÂ¬Ã…Â¾Ãƒâ€šÃ‚Â¢ÃƒÆ’Ã†â€™Ãƒâ€ Ã¢â‚¬â„¢ÃƒÆ’Ã¢â‚¬Â ÃƒÂ¢Ã¢â€šÂ¬Ã¢â€žÂ¢ÃƒÆ’Ã†â€™Ãƒâ€šÃ‚Â¢ÃƒÆ’Ã‚Â¢ÃƒÂ¢Ã¢â€šÂ¬Ã…Â¡Ãƒâ€šÃ‚Â¬ÃƒÆ’Ã¢â‚¬Å¡Ãƒâ€šÃ‚Â ÃƒÆ’Ã†â€™Ãƒâ€ Ã¢â‚¬â„¢ÃƒÆ’Ã¢â‚¬Å¡Ãƒâ€šÃ‚Â¢ÃƒÆ’Ã†â€™Ãƒâ€šÃ‚Â¢ÃƒÆ’Ã‚Â¢ÃƒÂ¢Ã¢â‚¬Å¡Ã‚Â¬Ãƒâ€¦Ã‚Â¡ÃƒÆ’Ã¢â‚¬Å¡Ãƒâ€šÃ‚Â¬ÃƒÆ’Ã†â€™Ãƒâ€šÃ‚Â¢ÃƒÆ’Ã‚Â¢ÃƒÂ¢Ã¢â‚¬Å¡Ã‚Â¬Ãƒâ€¦Ã‚Â¾ÃƒÆ’Ã¢â‚¬Å¡Ãƒâ€šÃ‚Â¢ÃƒÆ’Ã†â€™Ãƒâ€ Ã¢â‚¬â„¢ÃƒÆ’Ã¢â‚¬Â ÃƒÂ¢Ã¢â€šÂ¬Ã¢â€žÂ¢ÃƒÆ’Ã†â€™ÃƒÂ¢Ã¢â€šÂ¬Ã‚Â ÃƒÆ’Ã‚Â¢ÃƒÂ¢Ã¢â‚¬Å¡Ã‚Â¬ÃƒÂ¢Ã¢â‚¬Å¾Ã‚Â¢ÃƒÆ’Ã†â€™Ãƒâ€ Ã¢â‚¬â„¢ÃƒÆ’Ã¢â‚¬Å¡Ãƒâ€šÃ‚Â¢ÃƒÆ’Ã†â€™Ãƒâ€šÃ‚Â¢ÃƒÆ’Ã‚Â¢ÃƒÂ¢Ã¢â‚¬Å¡Ã‚Â¬Ãƒâ€¦Ã‚Â¡ÃƒÆ’Ã¢â‚¬Å¡Ãƒâ€šÃ‚Â¬ÃƒÆ’Ã†â€™ÃƒÂ¢Ã¢â€šÂ¬Ã…Â¡ÃƒÆ’Ã¢â‚¬Å¡Ãƒâ€šÃ‚Â¦ÃƒÆ’Ã†â€™Ãƒâ€ Ã¢â‚¬â„¢ÃƒÆ’Ã¢â‚¬Â ÃƒÂ¢Ã¢â€šÂ¬Ã¢â€žÂ¢ÃƒÆ’Ã†â€™Ãƒâ€šÃ‚Â¢ÃƒÆ’Ã‚Â¢ÃƒÂ¢Ã¢â€šÂ¬Ã…Â¡Ãƒâ€šÃ‚Â¬ÃƒÆ’Ã¢â‚¬Â¦Ãƒâ€šÃ‚Â¡ÃƒÆ’Ã†â€™Ãƒâ€ Ã¢â‚¬â„¢ÃƒÆ’Ã‚Â¢ÃƒÂ¢Ã¢â‚¬Å¡Ã‚Â¬Ãƒâ€¦Ã‚Â¡ÃƒÆ’Ã†â€™ÃƒÂ¢Ã¢â€šÂ¬Ã…Â¡ÃƒÆ’Ã¢â‚¬Å¡Ãƒâ€šÃ‚Â½ÃƒÆ’Ã†â€™Ãƒâ€ Ã¢â‚¬â„¢ÃƒÆ’Ã¢â‚¬Â ÃƒÂ¢Ã¢â€šÂ¬Ã¢â€žÂ¢ÃƒÆ’Ã†â€™ÃƒÂ¢Ã¢â€šÂ¬Ã‚Â ÃƒÆ’Ã‚Â¢ÃƒÂ¢Ã¢â‚¬Å¡Ã‚Â¬ÃƒÂ¢Ã¢â‚¬Å¾Ã‚Â¢ÃƒÆ’Ã†â€™Ãƒâ€ Ã¢â‚¬â„¢ÃƒÆ’Ã‚Â¢ÃƒÂ¢Ã¢â‚¬Å¡Ã‚Â¬Ãƒâ€šÃ‚Â ÃƒÆ’Ã†â€™Ãƒâ€šÃ‚Â¢ÃƒÆ’Ã‚Â¢ÃƒÂ¢Ã¢â€šÂ¬Ã…Â¡Ãƒâ€šÃ‚Â¬ÃƒÆ’Ã‚Â¢ÃƒÂ¢Ã¢â€šÂ¬Ã…Â¾Ãƒâ€šÃ‚Â¢ÃƒÆ’Ã†â€™Ãƒâ€ Ã¢â‚¬â„¢ÃƒÆ’Ã¢â‚¬Â ÃƒÂ¢Ã¢â€šÂ¬Ã¢â€žÂ¢ÃƒÆ’Ã†â€™ÃƒÂ¢Ã¢â€šÂ¬Ã…Â¡ÃƒÆ’Ã¢â‚¬Å¡Ãƒâ€šÃ‚Â¢ÃƒÆ’Ã†â€™Ãƒâ€ Ã¢â‚¬â„¢ÃƒÆ’Ã¢â‚¬Å¡Ãƒâ€šÃ‚Â¢ÃƒÆ’Ã†â€™Ãƒâ€šÃ‚Â¢ÃƒÆ’Ã‚Â¢ÃƒÂ¢Ã¢â€šÂ¬Ã…Â¡Ãƒâ€šÃ‚Â¬ÃƒÆ’Ã¢â‚¬Â¦Ãƒâ€šÃ‚Â¡ÃƒÆ’Ã†â€™ÃƒÂ¢Ã¢â€šÂ¬Ã…Â¡ÃƒÆ’Ã¢â‚¬Å¡Ãƒâ€šÃ‚Â¬ÃƒÆ’Ã†â€™Ãƒâ€ Ã¢â‚¬â„¢ÃƒÆ’Ã‚Â¢ÃƒÂ¢Ã¢â‚¬Å¡Ã‚Â¬Ãƒâ€šÃ‚Â¦ÃƒÆ’Ã†â€™ÃƒÂ¢Ã¢â€šÂ¬Ã…Â¡ÃƒÆ’Ã¢â‚¬Å¡Ãƒâ€šÃ‚Â¡ÃƒÆ’Ã†â€™Ãƒâ€ Ã¢â‚¬â„¢ÃƒÆ’Ã¢â‚¬Â ÃƒÂ¢Ã¢â€šÂ¬Ã¢â€žÂ¢ÃƒÆ’Ã†â€™ÃƒÂ¢Ã¢â€šÂ¬Ã‚Â ÃƒÆ’Ã‚Â¢ÃƒÂ¢Ã¢â‚¬Å¡Ã‚Â¬ÃƒÂ¢Ã¢â‚¬Å¾Ã‚Â¢ÃƒÆ’Ã†â€™Ãƒâ€ Ã¢â‚¬â„¢ÃƒÆ’Ã¢â‚¬Å¡Ãƒâ€šÃ‚Â¢ÃƒÆ’Ã†â€™Ãƒâ€šÃ‚Â¢ÃƒÆ’Ã‚Â¢ÃƒÂ¢Ã¢â‚¬Å¡Ã‚Â¬Ãƒâ€¦Ã‚Â¡ÃƒÆ’Ã¢â‚¬Å¡Ãƒâ€šÃ‚Â¬ÃƒÆ’Ã†â€™ÃƒÂ¢Ã¢â€šÂ¬Ã‚Â¦ÃƒÆ’Ã¢â‚¬Å¡Ãƒâ€šÃ‚Â¡ÃƒÆ’Ã†â€™Ãƒâ€ Ã¢â‚¬â„¢ÃƒÆ’Ã¢â‚¬Â ÃƒÂ¢Ã¢â€šÂ¬Ã¢â€žÂ¢ÃƒÆ’Ã†â€™Ãƒâ€šÃ‚Â¢ÃƒÆ’Ã‚Â¢ÃƒÂ¢Ã¢â€šÂ¬Ã…Â¡Ãƒâ€šÃ‚Â¬ÃƒÆ’Ã¢â‚¬Â¦Ãƒâ€šÃ‚Â¡ÃƒÆ’Ã†â€™Ãƒâ€ Ã¢â‚¬â„¢ÃƒÆ’Ã‚Â¢ÃƒÂ¢Ã¢â‚¬Å¡Ã‚Â¬Ãƒâ€¦Ã‚Â¡ÃƒÆ’Ã†â€™ÃƒÂ¢Ã¢â€šÂ¬Ã…Â¡ÃƒÆ’Ã¢â‚¬Å¡Ãƒâ€šÃ‚Â¼g</w:t>
       </w:r>
       <w:proofErr w:type="spellEnd"/>
       <w:r>
@@ -9152,7 +9152,7 @@
           <w:sz w:val="28"/>
           <w:szCs w:val="28"/>
         </w:rPr>
-        <w:t>ÃƒÆ’Ã†â€™Ãƒâ€ Ã¢â‚¬â„¢ÃƒÆ’Ã¢â‚¬Â ÃƒÂ¢Ã¢â€šÂ¬Ã¢â€žÂ¢ÃƒÆ’Ã†â€™ÃƒÂ¢Ã¢â€šÂ¬Ã‚Â ÃƒÆ’Ã‚Â¢ÃƒÂ¢Ã¢â‚¬Å¡Ã‚Â¬ÃƒÂ¢Ã¢â‚¬Å¾Ã‚Â¢ÃƒÆ’Ã†â€™Ãƒâ€ Ã¢â‚¬â„¢ÃƒÆ’Ã‚Â¢ÃƒÂ¢Ã¢â‚¬Å¡Ã‚Â¬Ãƒâ€šÃ‚Â¦ÃƒÆ’Ã†â€™ÃƒÂ¢Ã¢â€šÂ¬Ã…Â¡ÃƒÆ’Ã¢â‚¬Å¡Ãƒâ€šÃ‚Â½ÃƒÆ’Ã†â€™Ãƒâ€ Ã¢â‚¬â„¢ÃƒÆ’Ã¢â‚¬Â ÃƒÂ¢Ã¢â€šÂ¬Ã¢â€žÂ¢ÃƒÆ’Ã†â€™Ãƒâ€šÃ‚Â¢ÃƒÆ’Ã‚Â¢ÃƒÂ¢Ã¢â€šÂ¬Ã…Â¡Ãƒâ€šÃ‚Â¬ÃƒÆ’Ã¢â‚¬Â¦Ãƒâ€šÃ‚Â¡ÃƒÆ’Ã†â€™Ãƒâ€ Ã¢â‚¬â„¢ÃƒÆ’Ã‚Â¢ÃƒÂ¢Ã¢â‚¬Å¡Ã‚Â¬Ãƒâ€¦Ã‚Â¡ÃƒÆ’Ã†â€™ÃƒÂ¢Ã¢â€šÂ¬Ã…Â¡ÃƒÆ’Ã¢â‚¬Å¡Ãƒâ€šÃ‚Â¼g</w:t>
+        <w:t>ÃƒÆ’Ã†â€™Ãƒâ€ Ã¢â‚¬â„¢ÃƒÆ’Ã¢â‚¬Â ÃƒÂ¢Ã¢â€šÂ¬Ã¢â€žÂ¢ÃƒÆ’Ã†â€™ÃƒÂ¢Ã¢â€šÂ¬Ã‚Â ÃƒÆ’Ã‚Â¢ÃƒÂ¢Ã¢â‚¬Å¡Ã‚Â¬ÃƒÂ¢Ã¢â‚¬Å¾Ã‚Â¢ÃƒÆ’Ã†â€™Ãƒâ€ Ã¢â‚¬â„¢ÃƒÆ’Ã‚Â¢ÃƒÂ¢Ã¢â‚¬Å¡Ã‚Â¬Ãƒâ€šÃ‚Â ÃƒÆ’Ã†â€™Ãƒâ€šÃ‚Â¢ÃƒÆ’Ã‚Â¢ÃƒÂ¢Ã¢â€šÂ¬Ã…Â¡Ãƒâ€šÃ‚Â¬ÃƒÆ’Ã‚Â¢ÃƒÂ¢Ã¢â€šÂ¬Ã…Â¾Ãƒâ€šÃ‚Â¢ÃƒÆ’Ã†â€™Ãƒâ€ Ã¢â‚¬â„¢ÃƒÆ’Ã¢â‚¬Â ÃƒÂ¢Ã¢â€šÂ¬Ã¢â€žÂ¢ÃƒÆ’Ã†â€™Ãƒâ€šÃ‚Â¢ÃƒÆ’Ã‚Â¢ÃƒÂ¢Ã¢â€šÂ¬Ã…Â¡Ãƒâ€šÃ‚Â¬ÃƒÆ’Ã¢â‚¬Å¡Ãƒâ€šÃ‚Â ÃƒÆ’Ã†â€™Ãƒâ€ Ã¢â‚¬â„¢ÃƒÆ’Ã¢â‚¬Å¡Ãƒâ€šÃ‚Â¢ÃƒÆ’Ã†â€™Ãƒâ€šÃ‚Â¢ÃƒÆ’Ã‚Â¢ÃƒÂ¢Ã¢â‚¬Å¡Ã‚Â¬Ãƒâ€¦Ã‚Â¡ÃƒÆ’Ã¢â‚¬Å¡Ãƒâ€šÃ‚Â¬ÃƒÆ’Ã†â€™Ãƒâ€šÃ‚Â¢ÃƒÆ’Ã‚Â¢ÃƒÂ¢Ã¢â‚¬Å¡Ã‚Â¬Ãƒâ€¦Ã‚Â¾ÃƒÆ’Ã¢â‚¬Å¡Ãƒâ€šÃ‚Â¢ÃƒÆ’Ã†â€™Ãƒâ€ Ã¢â‚¬â„¢ÃƒÆ’Ã¢â‚¬Â ÃƒÂ¢Ã¢â€šÂ¬Ã¢â€žÂ¢ÃƒÆ’Ã†â€™ÃƒÂ¢Ã¢â€šÂ¬Ã‚Â ÃƒÆ’Ã‚Â¢ÃƒÂ¢Ã¢â‚¬Å¡Ã‚Â¬ÃƒÂ¢Ã¢â‚¬Å¾Ã‚Â¢ÃƒÆ’Ã†â€™Ãƒâ€ Ã¢â‚¬â„¢ÃƒÆ’Ã¢â‚¬Å¡Ãƒâ€šÃ‚Â¢ÃƒÆ’Ã†â€™Ãƒâ€šÃ‚Â¢ÃƒÆ’Ã‚Â¢ÃƒÂ¢Ã¢â‚¬Å¡Ã‚Â¬Ãƒâ€¦Ã‚Â¡ÃƒÆ’Ã¢â‚¬Å¡Ãƒâ€šÃ‚Â¬ÃƒÆ’Ã†â€™ÃƒÂ¢Ã¢â€šÂ¬Ã…Â¡ÃƒÆ’Ã¢â‚¬Å¡Ãƒâ€šÃ‚Â¦ÃƒÆ’Ã†â€™Ãƒâ€ Ã¢â‚¬â„¢ÃƒÆ’Ã¢â‚¬Â ÃƒÂ¢Ã¢â€šÂ¬Ã¢â€žÂ¢ÃƒÆ’Ã†â€™Ãƒâ€šÃ‚Â¢ÃƒÆ’Ã‚Â¢ÃƒÂ¢Ã¢â€šÂ¬Ã…Â¡Ãƒâ€šÃ‚Â¬ÃƒÆ’Ã¢â‚¬Â¦Ãƒâ€šÃ‚Â¡ÃƒÆ’Ã†â€™Ãƒâ€ Ã¢â‚¬â„¢ÃƒÆ’Ã‚Â¢ÃƒÂ¢Ã¢â‚¬Å¡Ã‚Â¬Ãƒâ€¦Ã‚Â¡ÃƒÆ’Ã†â€™ÃƒÂ¢Ã¢â€šÂ¬Ã…Â¡ÃƒÆ’Ã¢â‚¬Å¡Ãƒâ€šÃ‚Â½ÃƒÆ’Ã†â€™Ãƒâ€ Ã¢â‚¬â„¢ÃƒÆ’Ã¢â‚¬Â ÃƒÂ¢Ã¢â€šÂ¬Ã¢â€žÂ¢ÃƒÆ’Ã†â€™ÃƒÂ¢Ã¢â€šÂ¬Ã‚Â ÃƒÆ’Ã‚Â¢ÃƒÂ¢Ã¢â‚¬Å¡Ã‚Â¬ÃƒÂ¢Ã¢â‚¬Å¾Ã‚Â¢ÃƒÆ’Ã†â€™Ãƒâ€ Ã¢â‚¬â„¢ÃƒÆ’Ã‚Â¢ÃƒÂ¢Ã¢â‚¬Å¡Ã‚Â¬Ãƒâ€šÃ‚Â ÃƒÆ’Ã†â€™Ãƒâ€šÃ‚Â¢ÃƒÆ’Ã‚Â¢ÃƒÂ¢Ã¢â€šÂ¬Ã…Â¡Ãƒâ€šÃ‚Â¬ÃƒÆ’Ã‚Â¢ÃƒÂ¢Ã¢â€šÂ¬Ã…Â¾Ãƒâ€šÃ‚Â¢ÃƒÆ’Ã†â€™Ãƒâ€ Ã¢â‚¬â„¢ÃƒÆ’Ã¢â‚¬Â ÃƒÂ¢Ã¢â€šÂ¬Ã¢â€žÂ¢ÃƒÆ’Ã†â€™ÃƒÂ¢Ã¢â€šÂ¬Ã…Â¡ÃƒÆ’Ã¢â‚¬Å¡Ãƒâ€šÃ‚Â¢ÃƒÆ’Ã†â€™Ãƒâ€ Ã¢â‚¬â„¢ÃƒÆ’Ã¢â‚¬Å¡Ãƒâ€šÃ‚Â¢ÃƒÆ’Ã†â€™Ãƒâ€šÃ‚Â¢ÃƒÆ’Ã‚Â¢ÃƒÂ¢Ã¢â€šÂ¬Ã…Â¡Ãƒâ€šÃ‚Â¬ÃƒÆ’Ã¢â‚¬Â¦Ãƒâ€šÃ‚Â¡ÃƒÆ’Ã†â€™ÃƒÂ¢Ã¢â€šÂ¬Ã…Â¡ÃƒÆ’Ã¢â‚¬Å¡Ãƒâ€šÃ‚Â¬ÃƒÆ’Ã†â€™Ãƒâ€ Ã¢â‚¬â„¢ÃƒÆ’Ã‚Â¢ÃƒÂ¢Ã¢â‚¬Å¡Ã‚Â¬Ãƒâ€šÃ‚Â¦ÃƒÆ’Ã†â€™ÃƒÂ¢Ã¢â€šÂ¬Ã…Â¡ÃƒÆ’Ã¢â‚¬Å¡Ãƒâ€šÃ‚Â¡ÃƒÆ’Ã†â€™Ãƒâ€ Ã¢â‚¬â„¢ÃƒÆ’Ã¢â‚¬Â ÃƒÂ¢Ã¢â€šÂ¬Ã¢â€žÂ¢ÃƒÆ’Ã†â€™ÃƒÂ¢Ã¢â€šÂ¬Ã‚Â ÃƒÆ’Ã‚Â¢ÃƒÂ¢Ã¢â‚¬Å¡Ã‚Â¬ÃƒÂ¢Ã¢â‚¬Å¾Ã‚Â¢ÃƒÆ’Ã†â€™Ãƒâ€ Ã¢â‚¬â„¢ÃƒÆ’Ã¢â‚¬Å¡Ãƒâ€šÃ‚Â¢ÃƒÆ’Ã†â€™Ãƒâ€šÃ‚Â¢ÃƒÆ’Ã‚Â¢ÃƒÂ¢Ã¢â‚¬Å¡Ã‚Â¬Ãƒâ€¦Ã‚Â¡ÃƒÆ’Ã¢â‚¬Å¡Ãƒâ€šÃ‚Â¬ÃƒÆ’Ã†â€™ÃƒÂ¢Ã¢â€šÂ¬Ã‚Â¦ÃƒÆ’Ã¢â‚¬Å¡Ãƒâ€šÃ‚Â¡ÃƒÆ’Ã†â€™Ãƒâ€ Ã¢â‚¬â„¢ÃƒÆ’Ã¢â‚¬Â ÃƒÂ¢Ã¢â€šÂ¬Ã¢â€žÂ¢ÃƒÆ’Ã†â€™Ãƒâ€šÃ‚Â¢ÃƒÆ’Ã‚Â¢ÃƒÂ¢Ã¢â€šÂ¬Ã…Â¡Ãƒâ€šÃ‚Â¬ÃƒÆ’Ã¢â‚¬Â¦Ãƒâ€šÃ‚Â¡ÃƒÆ’Ã†â€™Ãƒâ€ Ã¢â‚¬â„¢ÃƒÆ’Ã‚Â¢ÃƒÂ¢Ã¢â‚¬Å¡Ã‚Â¬Ãƒâ€¦Ã‚Â¡ÃƒÆ’Ã†â€™ÃƒÂ¢Ã¢â€šÂ¬Ã…Â¡ÃƒÆ’Ã¢â‚¬Å¡Ãƒâ€šÃ‚Â¼g</w:t>
       </w:r>
       <w:proofErr w:type="spellEnd"/>
       <w:r>
@@ -9170,7 +9170,7 @@
           <w:sz w:val="28"/>
           <w:szCs w:val="28"/>
         </w:rPr>
-        <w:t>ÃƒÆ’Ã†â€™Ãƒâ€ Ã¢â‚¬â„¢ÃƒÆ’Ã¢â‚¬Â ÃƒÂ¢Ã¢â€šÂ¬Ã¢â€žÂ¢ÃƒÆ’Ã†â€™ÃƒÂ¢Ã¢â€šÂ¬Ã‚Â ÃƒÆ’Ã‚Â¢ÃƒÂ¢Ã¢â‚¬Å¡Ã‚Â¬ÃƒÂ¢Ã¢â‚¬Å¾Ã‚Â¢ÃƒÆ’Ã†â€™Ãƒâ€ Ã¢â‚¬â„¢ÃƒÆ’Ã‚Â¢ÃƒÂ¢Ã¢â‚¬Å¡Ã‚Â¬Ãƒâ€šÃ‚Â¦ÃƒÆ’Ã†â€™ÃƒÂ¢Ã¢â€šÂ¬Ã…Â¡ÃƒÆ’Ã¢â‚¬Å¡Ãƒâ€šÃ‚Â½ÃƒÆ’Ã†â€™Ãƒâ€ Ã¢â‚¬â„¢ÃƒÆ’Ã¢â‚¬Â ÃƒÂ¢Ã¢â€šÂ¬Ã¢â€žÂ¢ÃƒÆ’Ã†â€™Ãƒâ€šÃ‚Â¢ÃƒÆ’Ã‚Â¢ÃƒÂ¢Ã¢â€šÂ¬Ã…Â¡Ãƒâ€šÃ‚Â¬ÃƒÆ’Ã¢â‚¬Â¦Ãƒâ€šÃ‚Â¡ÃƒÆ’Ã†â€™Ãƒâ€ Ã¢â‚¬â„¢ÃƒÆ’Ã‚Â¢ÃƒÂ¢Ã¢â‚¬Å¡Ã‚Â¬Ãƒâ€¦Ã‚Â¡ÃƒÆ’Ã†â€™ÃƒÂ¢Ã¢â€šÂ¬Ã…Â¡ÃƒÆ’Ã¢â‚¬Å¡Ãƒâ€šÃ‚Â¼g</w:t>
+        <w:t>ÃƒÆ’Ã†â€™Ãƒâ€ Ã¢â‚¬â„¢ÃƒÆ’Ã¢â‚¬Â ÃƒÂ¢Ã¢â€šÂ¬Ã¢â€žÂ¢ÃƒÆ’Ã†â€™ÃƒÂ¢Ã¢â€šÂ¬Ã‚Â ÃƒÆ’Ã‚Â¢ÃƒÂ¢Ã¢â‚¬Å¡Ã‚Â¬ÃƒÂ¢Ã¢â‚¬Å¾Ã‚Â¢ÃƒÆ’Ã†â€™Ãƒâ€ Ã¢â‚¬â„¢ÃƒÆ’Ã‚Â¢ÃƒÂ¢Ã¢â‚¬Å¡Ã‚Â¬Ãƒâ€šÃ‚Â ÃƒÆ’Ã†â€™Ãƒâ€šÃ‚Â¢ÃƒÆ’Ã‚Â¢ÃƒÂ¢Ã¢â€šÂ¬Ã…Â¡Ãƒâ€šÃ‚Â¬ÃƒÆ’Ã‚Â¢ÃƒÂ¢Ã¢â€šÂ¬Ã…Â¾Ãƒâ€šÃ‚Â¢ÃƒÆ’Ã†â€™Ãƒâ€ Ã¢â‚¬â„¢ÃƒÆ’Ã¢â‚¬Â ÃƒÂ¢Ã¢â€šÂ¬Ã¢â€žÂ¢ÃƒÆ’Ã†â€™Ãƒâ€šÃ‚Â¢ÃƒÆ’Ã‚Â¢ÃƒÂ¢Ã¢â€šÂ¬Ã…Â¡Ãƒâ€šÃ‚Â¬ÃƒÆ’Ã¢â‚¬Å¡Ãƒâ€šÃ‚Â ÃƒÆ’Ã†â€™Ãƒâ€ Ã¢â‚¬â„¢ÃƒÆ’Ã¢â‚¬Å¡Ãƒâ€šÃ‚Â¢ÃƒÆ’Ã†â€™Ãƒâ€šÃ‚Â¢ÃƒÆ’Ã‚Â¢ÃƒÂ¢Ã¢â‚¬Å¡Ã‚Â¬Ãƒâ€¦Ã‚Â¡ÃƒÆ’Ã¢â‚¬Å¡Ãƒâ€šÃ‚Â¬ÃƒÆ’Ã†â€™Ãƒâ€šÃ‚Â¢ÃƒÆ’Ã‚Â¢ÃƒÂ¢Ã¢â‚¬Å¡Ã‚Â¬Ãƒâ€¦Ã‚Â¾ÃƒÆ’Ã¢â‚¬Å¡Ãƒâ€šÃ‚Â¢ÃƒÆ’Ã†â€™Ãƒâ€ Ã¢â‚¬â„¢ÃƒÆ’Ã¢â‚¬Â ÃƒÂ¢Ã¢â€šÂ¬Ã¢â€žÂ¢ÃƒÆ’Ã†â€™ÃƒÂ¢Ã¢â€šÂ¬Ã‚Â ÃƒÆ’Ã‚Â¢ÃƒÂ¢Ã¢â‚¬Å¡Ã‚Â¬ÃƒÂ¢Ã¢â‚¬Å¾Ã‚Â¢ÃƒÆ’Ã†â€™Ãƒâ€ Ã¢â‚¬â„¢ÃƒÆ’Ã¢â‚¬Å¡Ãƒâ€šÃ‚Â¢ÃƒÆ’Ã†â€™Ãƒâ€šÃ‚Â¢ÃƒÆ’Ã‚Â¢ÃƒÂ¢Ã¢â‚¬Å¡Ã‚Â¬Ãƒâ€¦Ã‚Â¡ÃƒÆ’Ã¢â‚¬Å¡Ãƒâ€šÃ‚Â¬ÃƒÆ’Ã†â€™ÃƒÂ¢Ã¢â€šÂ¬Ã…Â¡ÃƒÆ’Ã¢â‚¬Å¡Ãƒâ€šÃ‚Â¦ÃƒÆ’Ã†â€™Ãƒâ€ Ã¢â‚¬â„¢ÃƒÆ’Ã¢â‚¬Â ÃƒÂ¢Ã¢â€šÂ¬Ã¢â€žÂ¢ÃƒÆ’Ã†â€™Ãƒâ€šÃ‚Â¢ÃƒÆ’Ã‚Â¢ÃƒÂ¢Ã¢â€šÂ¬Ã…Â¡Ãƒâ€šÃ‚Â¬ÃƒÆ’Ã¢â‚¬Â¦Ãƒâ€šÃ‚Â¡ÃƒÆ’Ã†â€™Ãƒâ€ Ã¢â‚¬â„¢ÃƒÆ’Ã‚Â¢ÃƒÂ¢Ã¢â‚¬Å¡Ã‚Â¬Ãƒâ€¦Ã‚Â¡ÃƒÆ’Ã†â€™ÃƒÂ¢Ã¢â€šÂ¬Ã…Â¡ÃƒÆ’Ã¢â‚¬Å¡Ãƒâ€šÃ‚Â½ÃƒÆ’Ã†â€™Ãƒâ€ Ã¢â‚¬â„¢ÃƒÆ’Ã¢â‚¬Â ÃƒÂ¢Ã¢â€šÂ¬Ã¢â€žÂ¢ÃƒÆ’Ã†â€™ÃƒÂ¢Ã¢â€šÂ¬Ã‚Â ÃƒÆ’Ã‚Â¢ÃƒÂ¢Ã¢â‚¬Å¡Ã‚Â¬ÃƒÂ¢Ã¢â‚¬Å¾Ã‚Â¢ÃƒÆ’Ã†â€™Ãƒâ€ Ã¢â‚¬â„¢ÃƒÆ’Ã‚Â¢ÃƒÂ¢Ã¢â‚¬Å¡Ã‚Â¬Ãƒâ€šÃ‚Â ÃƒÆ’Ã†â€™Ãƒâ€šÃ‚Â¢ÃƒÆ’Ã‚Â¢ÃƒÂ¢Ã¢â€šÂ¬Ã…Â¡Ãƒâ€šÃ‚Â¬ÃƒÆ’Ã‚Â¢ÃƒÂ¢Ã¢â€šÂ¬Ã…Â¾Ãƒâ€šÃ‚Â¢ÃƒÆ’Ã†â€™Ãƒâ€ Ã¢â‚¬â„¢ÃƒÆ’Ã¢â‚¬Â ÃƒÂ¢Ã¢â€šÂ¬Ã¢â€žÂ¢ÃƒÆ’Ã†â€™ÃƒÂ¢Ã¢â€šÂ¬Ã…Â¡ÃƒÆ’Ã¢â‚¬Å¡Ãƒâ€šÃ‚Â¢ÃƒÆ’Ã†â€™Ãƒâ€ Ã¢â‚¬â„¢ÃƒÆ’Ã¢â‚¬Å¡Ãƒâ€šÃ‚Â¢ÃƒÆ’Ã†â€™Ãƒâ€šÃ‚Â¢ÃƒÆ’Ã‚Â¢ÃƒÂ¢Ã¢â€šÂ¬Ã…Â¡Ãƒâ€šÃ‚Â¬ÃƒÆ’Ã¢â‚¬Â¦Ãƒâ€šÃ‚Â¡ÃƒÆ’Ã†â€™ÃƒÂ¢Ã¢â€šÂ¬Ã…Â¡ÃƒÆ’Ã¢â‚¬Å¡Ãƒâ€šÃ‚Â¬ÃƒÆ’Ã†â€™Ãƒâ€ Ã¢â‚¬â„¢ÃƒÆ’Ã‚Â¢ÃƒÂ¢Ã¢â‚¬Å¡Ã‚Â¬Ãƒâ€šÃ‚Â¦ÃƒÆ’Ã†â€™ÃƒÂ¢Ã¢â€šÂ¬Ã…Â¡ÃƒÆ’Ã¢â‚¬Å¡Ãƒâ€šÃ‚Â¡ÃƒÆ’Ã†â€™Ãƒâ€ Ã¢â‚¬â„¢ÃƒÆ’Ã¢â‚¬Â ÃƒÂ¢Ã¢â€šÂ¬Ã¢â€žÂ¢ÃƒÆ’Ã†â€™ÃƒÂ¢Ã¢â€šÂ¬Ã‚Â ÃƒÆ’Ã‚Â¢ÃƒÂ¢Ã¢â‚¬Å¡Ã‚Â¬ÃƒÂ¢Ã¢â‚¬Å¾Ã‚Â¢ÃƒÆ’Ã†â€™Ãƒâ€ Ã¢â‚¬â„¢ÃƒÆ’Ã¢â‚¬Å¡Ãƒâ€šÃ‚Â¢ÃƒÆ’Ã†â€™Ãƒâ€šÃ‚Â¢ÃƒÆ’Ã‚Â¢ÃƒÂ¢Ã¢â‚¬Å¡Ã‚Â¬Ãƒâ€¦Ã‚Â¡ÃƒÆ’Ã¢â‚¬Å¡Ãƒâ€šÃ‚Â¬ÃƒÆ’Ã†â€™ÃƒÂ¢Ã¢â€šÂ¬Ã‚Â¦ÃƒÆ’Ã¢â‚¬Å¡Ãƒâ€šÃ‚Â¡ÃƒÆ’Ã†â€™Ãƒâ€ Ã¢â‚¬â„¢ÃƒÆ’Ã¢â‚¬Â ÃƒÂ¢Ã¢â€šÂ¬Ã¢â€žÂ¢ÃƒÆ’Ã†â€™Ãƒâ€šÃ‚Â¢ÃƒÆ’Ã‚Â¢ÃƒÂ¢Ã¢â€šÂ¬Ã…Â¡Ãƒâ€šÃ‚Â¬ÃƒÆ’Ã¢â‚¬Â¦Ãƒâ€šÃ‚Â¡ÃƒÆ’Ã†â€™Ãƒâ€ Ã¢â‚¬â„¢ÃƒÆ’Ã‚Â¢ÃƒÂ¢Ã¢â‚¬Å¡Ã‚Â¬Ãƒâ€¦Ã‚Â¡ÃƒÆ’Ã†â€™ÃƒÂ¢Ã¢â€šÂ¬Ã…Â¡ÃƒÆ’Ã¢â‚¬Å¡Ãƒâ€šÃ‚Â¼g</w:t>
       </w:r>
       <w:proofErr w:type="spellEnd"/>
       <w:r>
@@ -9188,7 +9188,7 @@
           <w:sz w:val="28"/>
           <w:szCs w:val="28"/>
         </w:rPr>
-        <w:t>ÃƒÆ’Ã†â€™Ãƒâ€ Ã¢â‚¬â„¢ÃƒÆ’Ã¢â‚¬Â ÃƒÂ¢Ã¢â€šÂ¬Ã¢â€žÂ¢ÃƒÆ’Ã†â€™ÃƒÂ¢Ã¢â€šÂ¬Ã‚Â ÃƒÆ’Ã‚Â¢ÃƒÂ¢Ã¢â‚¬Å¡Ã‚Â¬ÃƒÂ¢Ã¢â‚¬Å¾Ã‚Â¢ÃƒÆ’Ã†â€™Ãƒâ€ Ã¢â‚¬â„¢ÃƒÆ’Ã‚Â¢ÃƒÂ¢Ã¢â‚¬Å¡Ã‚Â¬Ãƒâ€šÃ‚Â¦ÃƒÆ’Ã†â€™ÃƒÂ¢Ã¢â€šÂ¬Ã…Â¡ÃƒÆ’Ã¢â‚¬Å¡Ãƒâ€šÃ‚Â½ÃƒÆ’Ã†â€™Ãƒâ€ Ã¢â‚¬â„¢ÃƒÆ’Ã¢â‚¬Â ÃƒÂ¢Ã¢â€šÂ¬Ã¢â€žÂ¢ÃƒÆ’Ã†â€™Ãƒâ€šÃ‚Â¢ÃƒÆ’Ã‚Â¢ÃƒÂ¢Ã¢â€šÂ¬Ã…Â¡Ãƒâ€šÃ‚Â¬ÃƒÆ’Ã¢â‚¬Â¦Ãƒâ€šÃ‚Â¡ÃƒÆ’Ã†â€™Ãƒâ€ Ã¢â‚¬â„¢ÃƒÆ’Ã‚Â¢ÃƒÂ¢Ã¢â‚¬Å¡Ã‚Â¬Ãƒâ€¦Ã‚Â¡ÃƒÆ’Ã†â€™ÃƒÂ¢Ã¢â€šÂ¬Ã…Â¡ÃƒÆ’Ã¢â‚¬Å¡Ãƒâ€šÃ‚Â¼g</w:t>
+        <w:t>ÃƒÆ’Ã†â€™Ãƒâ€ Ã¢â‚¬â„¢ÃƒÆ’Ã¢â‚¬Â ÃƒÂ¢Ã¢â€šÂ¬Ã¢â€žÂ¢ÃƒÆ’Ã†â€™ÃƒÂ¢Ã¢â€šÂ¬Ã‚Â ÃƒÆ’Ã‚Â¢ÃƒÂ¢Ã¢â‚¬Å¡Ã‚Â¬ÃƒÂ¢Ã¢â‚¬Å¾Ã‚Â¢ÃƒÆ’Ã†â€™Ãƒâ€ Ã¢â‚¬â„¢ÃƒÆ’Ã‚Â¢ÃƒÂ¢Ã¢â‚¬Å¡Ã‚Â¬Ãƒâ€šÃ‚Â ÃƒÆ’Ã†â€™Ãƒâ€šÃ‚Â¢ÃƒÆ’Ã‚Â¢ÃƒÂ¢Ã¢â€šÂ¬Ã…Â¡Ãƒâ€šÃ‚Â¬ÃƒÆ’Ã‚Â¢ÃƒÂ¢Ã¢â€šÂ¬Ã…Â¾Ãƒâ€šÃ‚Â¢ÃƒÆ’Ã†â€™Ãƒâ€ Ã¢â‚¬â„¢ÃƒÆ’Ã¢â‚¬Â ÃƒÂ¢Ã¢â€šÂ¬Ã¢â€žÂ¢ÃƒÆ’Ã†â€™Ãƒâ€šÃ‚Â¢ÃƒÆ’Ã‚Â¢ÃƒÂ¢Ã¢â€šÂ¬Ã…Â¡Ãƒâ€šÃ‚Â¬ÃƒÆ’Ã¢â‚¬Å¡Ãƒâ€šÃ‚Â ÃƒÆ’Ã†â€™Ãƒâ€ Ã¢â‚¬â„¢ÃƒÆ’Ã¢â‚¬Å¡Ãƒâ€šÃ‚Â¢ÃƒÆ’Ã†â€™Ãƒâ€šÃ‚Â¢ÃƒÆ’Ã‚Â¢ÃƒÂ¢Ã¢â‚¬Å¡Ã‚Â¬Ãƒâ€¦Ã‚Â¡ÃƒÆ’Ã¢â‚¬Å¡Ãƒâ€šÃ‚Â¬ÃƒÆ’Ã†â€™Ãƒâ€šÃ‚Â¢ÃƒÆ’Ã‚Â¢ÃƒÂ¢Ã¢â‚¬Å¡Ã‚Â¬Ãƒâ€¦Ã‚Â¾ÃƒÆ’Ã¢â‚¬Å¡Ãƒâ€šÃ‚Â¢ÃƒÆ’Ã†â€™Ãƒâ€ Ã¢â‚¬â„¢ÃƒÆ’Ã¢â‚¬Â ÃƒÂ¢Ã¢â€šÂ¬Ã¢â€žÂ¢ÃƒÆ’Ã†â€™ÃƒÂ¢Ã¢â€šÂ¬Ã‚Â ÃƒÆ’Ã‚Â¢ÃƒÂ¢Ã¢â‚¬Å¡Ã‚Â¬ÃƒÂ¢Ã¢â‚¬Å¾Ã‚Â¢ÃƒÆ’Ã†â€™Ãƒâ€ Ã¢â‚¬â„¢ÃƒÆ’Ã¢â‚¬Å¡Ãƒâ€šÃ‚Â¢ÃƒÆ’Ã†â€™Ãƒâ€šÃ‚Â¢ÃƒÆ’Ã‚Â¢ÃƒÂ¢Ã¢â‚¬Å¡Ã‚Â¬Ãƒâ€¦Ã‚Â¡ÃƒÆ’Ã¢â‚¬Å¡Ãƒâ€šÃ‚Â¬ÃƒÆ’Ã†â€™ÃƒÂ¢Ã¢â€šÂ¬Ã…Â¡ÃƒÆ’Ã¢â‚¬Å¡Ãƒâ€šÃ‚Â¦ÃƒÆ’Ã†â€™Ãƒâ€ Ã¢â‚¬â„¢ÃƒÆ’Ã¢â‚¬Â ÃƒÂ¢Ã¢â€šÂ¬Ã¢â€žÂ¢ÃƒÆ’Ã†â€™Ãƒâ€šÃ‚Â¢ÃƒÆ’Ã‚Â¢ÃƒÂ¢Ã¢â€šÂ¬Ã…Â¡Ãƒâ€šÃ‚Â¬ÃƒÆ’Ã¢â‚¬Â¦Ãƒâ€šÃ‚Â¡ÃƒÆ’Ã†â€™Ãƒâ€ Ã¢â‚¬â„¢ÃƒÆ’Ã‚Â¢ÃƒÂ¢Ã¢â‚¬Å¡Ã‚Â¬Ãƒâ€¦Ã‚Â¡ÃƒÆ’Ã†â€™ÃƒÂ¢Ã¢â€šÂ¬Ã…Â¡ÃƒÆ’Ã¢â‚¬Å¡Ãƒâ€šÃ‚Â½ÃƒÆ’Ã†â€™Ãƒâ€ Ã¢â‚¬â„¢ÃƒÆ’Ã¢â‚¬Â ÃƒÂ¢Ã¢â€šÂ¬Ã¢â€žÂ¢ÃƒÆ’Ã†â€™ÃƒÂ¢Ã¢â€šÂ¬Ã‚Â ÃƒÆ’Ã‚Â¢ÃƒÂ¢Ã¢â‚¬Å¡Ã‚Â¬ÃƒÂ¢Ã¢â‚¬Å¾Ã‚Â¢ÃƒÆ’Ã†â€™Ãƒâ€ Ã¢â‚¬â„¢ÃƒÆ’Ã‚Â¢ÃƒÂ¢Ã¢â‚¬Å¡Ã‚Â¬Ãƒâ€šÃ‚Â ÃƒÆ’Ã†â€™Ãƒâ€šÃ‚Â¢ÃƒÆ’Ã‚Â¢ÃƒÂ¢Ã¢â€šÂ¬Ã…Â¡Ãƒâ€šÃ‚Â¬ÃƒÆ’Ã‚Â¢ÃƒÂ¢Ã¢â€šÂ¬Ã…Â¾Ãƒâ€šÃ‚Â¢ÃƒÆ’Ã†â€™Ãƒâ€ Ã¢â‚¬â„¢ÃƒÆ’Ã¢â‚¬Â ÃƒÂ¢Ã¢â€šÂ¬Ã¢â€žÂ¢ÃƒÆ’Ã†â€™ÃƒÂ¢Ã¢â€šÂ¬Ã…Â¡ÃƒÆ’Ã¢â‚¬Å¡Ãƒâ€šÃ‚Â¢ÃƒÆ’Ã†â€™Ãƒâ€ Ã¢â‚¬â„¢ÃƒÆ’Ã¢â‚¬Å¡Ãƒâ€šÃ‚Â¢ÃƒÆ’Ã†â€™Ãƒâ€šÃ‚Â¢ÃƒÆ’Ã‚Â¢ÃƒÂ¢Ã¢â€šÂ¬Ã…Â¡Ãƒâ€šÃ‚Â¬ÃƒÆ’Ã¢â‚¬Â¦Ãƒâ€šÃ‚Â¡ÃƒÆ’Ã†â€™ÃƒÂ¢Ã¢â€šÂ¬Ã…Â¡ÃƒÆ’Ã¢â‚¬Å¡Ãƒâ€šÃ‚Â¬ÃƒÆ’Ã†â€™Ãƒâ€ Ã¢â‚¬â„¢ÃƒÆ’Ã‚Â¢ÃƒÂ¢Ã¢â‚¬Å¡Ã‚Â¬Ãƒâ€šÃ‚Â¦ÃƒÆ’Ã†â€™ÃƒÂ¢Ã¢â€šÂ¬Ã…Â¡ÃƒÆ’Ã¢â‚¬Å¡Ãƒâ€šÃ‚Â¡ÃƒÆ’Ã†â€™Ãƒâ€ Ã¢â‚¬â„¢ÃƒÆ’Ã¢â‚¬Â ÃƒÂ¢Ã¢â€šÂ¬Ã¢â€žÂ¢ÃƒÆ’Ã†â€™ÃƒÂ¢Ã¢â€šÂ¬Ã‚Â ÃƒÆ’Ã‚Â¢ÃƒÂ¢Ã¢â‚¬Å¡Ã‚Â¬ÃƒÂ¢Ã¢â‚¬Å¾Ã‚Â¢ÃƒÆ’Ã†â€™Ãƒâ€ Ã¢â‚¬â„¢ÃƒÆ’Ã¢â‚¬Å¡Ãƒâ€šÃ‚Â¢ÃƒÆ’Ã†â€™Ãƒâ€šÃ‚Â¢ÃƒÆ’Ã‚Â¢ÃƒÂ¢Ã¢â‚¬Å¡Ã‚Â¬Ãƒâ€¦Ã‚Â¡ÃƒÆ’Ã¢â‚¬Å¡Ãƒâ€šÃ‚Â¬ÃƒÆ’Ã†â€™ÃƒÂ¢Ã¢â€šÂ¬Ã‚Â¦ÃƒÆ’Ã¢â‚¬Å¡Ãƒâ€šÃ‚Â¡ÃƒÆ’Ã†â€™Ãƒâ€ Ã¢â‚¬â„¢ÃƒÆ’Ã¢â‚¬Â ÃƒÂ¢Ã¢â€šÂ¬Ã¢â€žÂ¢ÃƒÆ’Ã†â€™Ãƒâ€šÃ‚Â¢ÃƒÆ’Ã‚Â¢ÃƒÂ¢Ã¢â€šÂ¬Ã…Â¡Ãƒâ€šÃ‚Â¬ÃƒÆ’Ã¢â‚¬Â¦Ãƒâ€šÃ‚Â¡ÃƒÆ’Ã†â€™Ãƒâ€ Ã¢â‚¬â„¢ÃƒÆ’Ã‚Â¢ÃƒÂ¢Ã¢â‚¬Å¡Ã‚Â¬Ãƒâ€¦Ã‚Â¡ÃƒÆ’Ã†â€™ÃƒÂ¢Ã¢â€šÂ¬Ã…Â¡ÃƒÆ’Ã¢â‚¬Å¡Ãƒâ€šÃ‚Â¼g</w:t>
       </w:r>
       <w:proofErr w:type="spellEnd"/>
       <w:r>
@@ -9206,7 +9206,7 @@
           <w:sz w:val="28"/>
           <w:szCs w:val="28"/>
         </w:rPr>
-        <w:t>ÃƒÆ’Ã†â€™Ãƒâ€ Ã¢â‚¬â„¢ÃƒÆ’Ã¢â‚¬Â ÃƒÂ¢Ã¢â€šÂ¬Ã¢â€žÂ¢ÃƒÆ’Ã†â€™ÃƒÂ¢Ã¢â€šÂ¬Ã‚Â ÃƒÆ’Ã‚Â¢ÃƒÂ¢Ã¢â‚¬Å¡Ã‚Â¬ÃƒÂ¢Ã¢â‚¬Å¾Ã‚Â¢ÃƒÆ’Ã†â€™Ãƒâ€ Ã¢â‚¬â„¢ÃƒÆ’Ã‚Â¢ÃƒÂ¢Ã¢â‚¬Å¡Ã‚Â¬Ãƒâ€šÃ‚Â¦ÃƒÆ’Ã†â€™ÃƒÂ¢Ã¢â€šÂ¬Ã…Â¡ÃƒÆ’Ã¢â‚¬Å¡Ãƒâ€šÃ‚Â½ÃƒÆ’Ã†â€™Ãƒâ€ Ã¢â‚¬â„¢ÃƒÆ’Ã¢â‚¬Â ÃƒÂ¢Ã¢â€šÂ¬Ã¢â€žÂ¢ÃƒÆ’Ã†â€™Ãƒâ€šÃ‚Â¢ÃƒÆ’Ã‚Â¢ÃƒÂ¢Ã¢â€šÂ¬Ã…Â¡Ãƒâ€šÃ‚Â¬ÃƒÆ’Ã¢â‚¬Â¦Ãƒâ€šÃ‚Â¡ÃƒÆ’Ã†â€™Ãƒâ€ Ã¢â‚¬â„¢ÃƒÆ’Ã‚Â¢ÃƒÂ¢Ã¢â‚¬Å¡Ã‚Â¬Ãƒâ€¦Ã‚Â¡ÃƒÆ’Ã†â€™ÃƒÂ¢Ã¢â€šÂ¬Ã…Â¡ÃƒÆ’Ã¢â‚¬Å¡Ãƒâ€šÃ‚Â¼g</w:t>
+        <w:t>ÃƒÆ’Ã†â€™Ãƒâ€ Ã¢â‚¬â„¢ÃƒÆ’Ã¢â‚¬Â ÃƒÂ¢Ã¢â€šÂ¬Ã¢â€žÂ¢ÃƒÆ’Ã†â€™ÃƒÂ¢Ã¢â€šÂ¬Ã‚Â ÃƒÆ’Ã‚Â¢ÃƒÂ¢Ã¢â‚¬Å¡Ã‚Â¬ÃƒÂ¢Ã¢â‚¬Å¾Ã‚Â¢ÃƒÆ’Ã†â€™Ãƒâ€ Ã¢â‚¬â„¢ÃƒÆ’Ã‚Â¢ÃƒÂ¢Ã¢â‚¬Å¡Ã‚Â¬Ãƒâ€šÃ‚Â ÃƒÆ’Ã†â€™Ãƒâ€šÃ‚Â¢ÃƒÆ’Ã‚Â¢ÃƒÂ¢Ã¢â€šÂ¬Ã…Â¡Ãƒâ€šÃ‚Â¬ÃƒÆ’Ã‚Â¢ÃƒÂ¢Ã¢â€šÂ¬Ã…Â¾Ãƒâ€šÃ‚Â¢ÃƒÆ’Ã†â€™Ãƒâ€ Ã¢â‚¬â„¢ÃƒÆ’Ã¢â‚¬Â ÃƒÂ¢Ã¢â€šÂ¬Ã¢â€žÂ¢ÃƒÆ’Ã†â€™Ãƒâ€šÃ‚Â¢ÃƒÆ’Ã‚Â¢ÃƒÂ¢Ã¢â€šÂ¬Ã…Â¡Ãƒâ€šÃ‚Â¬ÃƒÆ’Ã¢â‚¬Å¡Ãƒâ€šÃ‚Â ÃƒÆ’Ã†â€™Ãƒâ€ Ã¢â‚¬â„¢ÃƒÆ’Ã¢â‚¬Å¡Ãƒâ€šÃ‚Â¢ÃƒÆ’Ã†â€™Ãƒâ€šÃ‚Â¢ÃƒÆ’Ã‚Â¢ÃƒÂ¢Ã¢â‚¬Å¡Ã‚Â¬Ãƒâ€¦Ã‚Â¡ÃƒÆ’Ã¢â‚¬Å¡Ãƒâ€šÃ‚Â¬ÃƒÆ’Ã†â€™Ãƒâ€šÃ‚Â¢ÃƒÆ’Ã‚Â¢ÃƒÂ¢Ã¢â‚¬Å¡Ã‚Â¬Ãƒâ€¦Ã‚Â¾ÃƒÆ’Ã¢â‚¬Å¡Ãƒâ€šÃ‚Â¢ÃƒÆ’Ã†â€™Ãƒâ€ Ã¢â‚¬â„¢ÃƒÆ’Ã¢â‚¬Â ÃƒÂ¢Ã¢â€šÂ¬Ã¢â€žÂ¢ÃƒÆ’Ã†â€™ÃƒÂ¢Ã¢â€šÂ¬Ã‚Â ÃƒÆ’Ã‚Â¢ÃƒÂ¢Ã¢â‚¬Å¡Ã‚Â¬ÃƒÂ¢Ã¢â‚¬Å¾Ã‚Â¢ÃƒÆ’Ã†â€™Ãƒâ€ Ã¢â‚¬â„¢ÃƒÆ’Ã¢â‚¬Å¡Ãƒâ€šÃ‚Â¢ÃƒÆ’Ã†â€™Ãƒâ€šÃ‚Â¢ÃƒÆ’Ã‚Â¢ÃƒÂ¢Ã¢â‚¬Å¡Ã‚Â¬Ãƒâ€¦Ã‚Â¡ÃƒÆ’Ã¢â‚¬Å¡Ãƒâ€šÃ‚Â¬ÃƒÆ’Ã†â€™ÃƒÂ¢Ã¢â€šÂ¬Ã…Â¡ÃƒÆ’Ã¢â‚¬Å¡Ãƒâ€šÃ‚Â¦ÃƒÆ’Ã†â€™Ãƒâ€ Ã¢â‚¬â„¢ÃƒÆ’Ã¢â‚¬Â ÃƒÂ¢Ã¢â€šÂ¬Ã¢â€žÂ¢ÃƒÆ’Ã†â€™Ãƒâ€šÃ‚Â¢ÃƒÆ’Ã‚Â¢ÃƒÂ¢Ã¢â€šÂ¬Ã…Â¡Ãƒâ€šÃ‚Â¬ÃƒÆ’Ã¢â‚¬Â¦Ãƒâ€šÃ‚Â¡ÃƒÆ’Ã†â€™Ãƒâ€ Ã¢â‚¬â„¢ÃƒÆ’Ã‚Â¢ÃƒÂ¢Ã¢â‚¬Å¡Ã‚Â¬Ãƒâ€¦Ã‚Â¡ÃƒÆ’Ã†â€™ÃƒÂ¢Ã¢â€šÂ¬Ã…Â¡ÃƒÆ’Ã¢â‚¬Å¡Ãƒâ€šÃ‚Â½ÃƒÆ’Ã†â€™Ãƒâ€ Ã¢â‚¬â„¢ÃƒÆ’Ã¢â‚¬Â ÃƒÂ¢Ã¢â€šÂ¬Ã¢â€žÂ¢ÃƒÆ’Ã†â€™ÃƒÂ¢Ã¢â€šÂ¬Ã‚Â ÃƒÆ’Ã‚Â¢ÃƒÂ¢Ã¢â‚¬Å¡Ã‚Â¬ÃƒÂ¢Ã¢â‚¬Å¾Ã‚Â¢ÃƒÆ’Ã†â€™Ãƒâ€ Ã¢â‚¬â„¢ÃƒÆ’Ã‚Â¢ÃƒÂ¢Ã¢â‚¬Å¡Ã‚Â¬Ãƒâ€šÃ‚Â ÃƒÆ’Ã†â€™Ãƒâ€šÃ‚Â¢ÃƒÆ’Ã‚Â¢ÃƒÂ¢Ã¢â€šÂ¬Ã…Â¡Ãƒâ€šÃ‚Â¬ÃƒÆ’Ã‚Â¢ÃƒÂ¢Ã¢â€šÂ¬Ã…Â¾Ãƒâ€šÃ‚Â¢ÃƒÆ’Ã†â€™Ãƒâ€ Ã¢â‚¬â„¢ÃƒÆ’Ã¢â‚¬Â ÃƒÂ¢Ã¢â€šÂ¬Ã¢â€žÂ¢ÃƒÆ’Ã†â€™ÃƒÂ¢Ã¢â€šÂ¬Ã…Â¡ÃƒÆ’Ã¢â‚¬Å¡Ãƒâ€šÃ‚Â¢ÃƒÆ’Ã†â€™Ãƒâ€ Ã¢â‚¬â„¢ÃƒÆ’Ã¢â‚¬Å¡Ãƒâ€šÃ‚Â¢ÃƒÆ’Ã†â€™Ãƒâ€šÃ‚Â¢ÃƒÆ’Ã‚Â¢ÃƒÂ¢Ã¢â€šÂ¬Ã…Â¡Ãƒâ€šÃ‚Â¬ÃƒÆ’Ã¢â‚¬Â¦Ãƒâ€šÃ‚Â¡ÃƒÆ’Ã†â€™ÃƒÂ¢Ã¢â€šÂ¬Ã…Â¡ÃƒÆ’Ã¢â‚¬Å¡Ãƒâ€šÃ‚Â¬ÃƒÆ’Ã†â€™Ãƒâ€ Ã¢â‚¬â„¢ÃƒÆ’Ã‚Â¢ÃƒÂ¢Ã¢â‚¬Å¡Ã‚Â¬Ãƒâ€šÃ‚Â¦ÃƒÆ’Ã†â€™ÃƒÂ¢Ã¢â€šÂ¬Ã…Â¡ÃƒÆ’Ã¢â‚¬Å¡Ãƒâ€šÃ‚Â¡ÃƒÆ’Ã†â€™Ãƒâ€ Ã¢â‚¬â„¢ÃƒÆ’Ã¢â‚¬Â ÃƒÂ¢Ã¢â€šÂ¬Ã¢â€žÂ¢ÃƒÆ’Ã†â€™ÃƒÂ¢Ã¢â€šÂ¬Ã‚Â ÃƒÆ’Ã‚Â¢ÃƒÂ¢Ã¢â‚¬Å¡Ã‚Â¬ÃƒÂ¢Ã¢â‚¬Å¾Ã‚Â¢ÃƒÆ’Ã†â€™Ãƒâ€ Ã¢â‚¬â„¢ÃƒÆ’Ã¢â‚¬Å¡Ãƒâ€šÃ‚Â¢ÃƒÆ’Ã†â€™Ãƒâ€šÃ‚Â¢ÃƒÆ’Ã‚Â¢ÃƒÂ¢Ã¢â‚¬Å¡Ã‚Â¬Ãƒâ€¦Ã‚Â¡ÃƒÆ’Ã¢â‚¬Å¡Ãƒâ€šÃ‚Â¬ÃƒÆ’Ã†â€™ÃƒÂ¢Ã¢â€šÂ¬Ã‚Â¦ÃƒÆ’Ã¢â‚¬Å¡Ãƒâ€šÃ‚Â¡ÃƒÆ’Ã†â€™Ãƒâ€ Ã¢â‚¬â„¢ÃƒÆ’Ã¢â‚¬Â ÃƒÂ¢Ã¢â€šÂ¬Ã¢â€žÂ¢ÃƒÆ’Ã†â€™Ãƒâ€šÃ‚Â¢ÃƒÆ’Ã‚Â¢ÃƒÂ¢Ã¢â€šÂ¬Ã…Â¡Ãƒâ€šÃ‚Â¬ÃƒÆ’Ã¢â‚¬Â¦Ãƒâ€šÃ‚Â¡ÃƒÆ’Ã†â€™Ãƒâ€ Ã¢â‚¬â„¢ÃƒÆ’Ã‚Â¢ÃƒÂ¢Ã¢â‚¬Å¡Ã‚Â¬Ãƒâ€¦Ã‚Â¡ÃƒÆ’Ã†â€™ÃƒÂ¢Ã¢â€šÂ¬Ã…Â¡ÃƒÆ’Ã¢â‚¬Å¡Ãƒâ€šÃ‚Â¼g</w:t>
       </w:r>
       <w:proofErr w:type="spellEnd"/>
       <w:r>

</xml_diff>

<commit_message>
Refresh generated report output
</commit_message>
<xml_diff>
--- a/result.docx
+++ b/result.docx
@@ -1694,7 +1694,7 @@
           <w:b/>
           <w:bCs/>
         </w:rPr>
-        <w:t xml:space="preserve">Table 2: Descriptive Statistics and WelchÃƒÆ’Ã†â€™Ãƒâ€ Ã¢â‚¬â„¢ÃƒÆ’Ã¢â‚¬Â ÃƒÂ¢Ã¢â€šÂ¬Ã¢â€žÂ¢ÃƒÆ’Ã†â€™ÃƒÂ¢Ã¢â€šÂ¬Ã‚Â ÃƒÆ’Ã‚Â¢ÃƒÂ¢Ã¢â‚¬Å¡Ã‚Â¬ÃƒÂ¢Ã¢â‚¬Å¾Ã‚Â¢ÃƒÆ’Ã†â€™Ãƒâ€ Ã¢â‚¬â„¢ÃƒÆ’Ã‚Â¢ÃƒÂ¢Ã¢â‚¬Å¡Ã‚Â¬Ãƒâ€šÃ‚Â ÃƒÆ’Ã†â€™Ãƒâ€šÃ‚Â¢ÃƒÆ’Ã‚Â¢ÃƒÂ¢Ã¢â€šÂ¬Ã…Â¡Ãƒâ€šÃ‚Â¬ÃƒÆ’Ã‚Â¢ÃƒÂ¢Ã¢â€šÂ¬Ã…Â¾Ãƒâ€šÃ‚Â¢ÃƒÆ’Ã†â€™Ãƒâ€ Ã¢â‚¬â„¢ÃƒÆ’Ã¢â‚¬Â ÃƒÂ¢Ã¢â€šÂ¬Ã¢â€žÂ¢ÃƒÆ’Ã†â€™Ãƒâ€šÃ‚Â¢ÃƒÆ’Ã‚Â¢ÃƒÂ¢Ã¢â€šÂ¬Ã…Â¡Ãƒâ€šÃ‚Â¬ÃƒÆ’Ã¢â‚¬Å¡Ãƒâ€šÃ‚Â ÃƒÆ’Ã†â€™Ãƒâ€ Ã¢â‚¬â„¢ÃƒÆ’Ã¢â‚¬Å¡Ãƒâ€šÃ‚Â¢ÃƒÆ’Ã†â€™Ãƒâ€šÃ‚Â¢ÃƒÆ’Ã‚Â¢ÃƒÂ¢Ã¢â‚¬Å¡Ã‚Â¬Ãƒâ€¦Ã‚Â¡ÃƒÆ’Ã¢â‚¬Å¡Ãƒâ€šÃ‚Â¬ÃƒÆ’Ã†â€™Ãƒâ€šÃ‚Â¢ÃƒÆ’Ã‚Â¢ÃƒÂ¢Ã¢â‚¬Å¡Ã‚Â¬Ãƒâ€¦Ã‚Â¾ÃƒÆ’Ã¢â‚¬Å¡Ãƒâ€šÃ‚Â¢ÃƒÆ’Ã†â€™Ãƒâ€ Ã¢â‚¬â„¢ÃƒÆ’Ã¢â‚¬Â ÃƒÂ¢Ã¢â€šÂ¬Ã¢â€žÂ¢ÃƒÆ’Ã†â€™ÃƒÂ¢Ã¢â€šÂ¬Ã‚Â ÃƒÆ’Ã‚Â¢ÃƒÂ¢Ã¢â‚¬Å¡Ã‚Â¬ÃƒÂ¢Ã¢â‚¬Å¾Ã‚Â¢ÃƒÆ’Ã†â€™Ãƒâ€ Ã¢â‚¬â„¢ÃƒÆ’Ã¢â‚¬Å¡Ãƒâ€šÃ‚Â¢ÃƒÆ’Ã†â€™Ãƒâ€šÃ‚Â¢ÃƒÆ’Ã‚Â¢ÃƒÂ¢Ã¢â‚¬Å¡Ã‚Â¬Ãƒâ€¦Ã‚Â¡ÃƒÆ’Ã¢â‚¬Å¡Ãƒâ€šÃ‚Â¬ÃƒÆ’Ã†â€™ÃƒÂ¢Ã¢â€šÂ¬Ã‚Â¦ÃƒÆ’Ã¢â‚¬Å¡Ãƒâ€šÃ‚Â¡ÃƒÆ’Ã†â€™Ãƒâ€ Ã¢â‚¬â„¢ÃƒÆ’Ã¢â‚¬Â ÃƒÂ¢Ã¢â€šÂ¬Ã¢â€žÂ¢ÃƒÆ’Ã†â€™Ãƒâ€šÃ‚Â¢ÃƒÆ’Ã‚Â¢ÃƒÂ¢Ã¢â€šÂ¬Ã…Â¡Ãƒâ€šÃ‚Â¬ÃƒÆ’Ã¢â‚¬Â¦Ãƒâ€šÃ‚Â¡ÃƒÆ’Ã†â€™Ãƒâ€ Ã¢â‚¬â„¢ÃƒÆ’Ã‚Â¢ÃƒÂ¢Ã¢â‚¬Å¡Ã‚Â¬Ãƒâ€¦Ã‚Â¡ÃƒÆ’Ã†â€™ÃƒÂ¢Ã¢â€šÂ¬Ã…Â¡ÃƒÆ’Ã¢â‚¬Å¡Ãƒâ€šÃ‚Â¢ÃƒÆ’Ã†â€™Ãƒâ€ Ã¢â‚¬â„¢ÃƒÆ’Ã¢â‚¬Â ÃƒÂ¢Ã¢â€šÂ¬Ã¢â€žÂ¢ÃƒÆ’Ã†â€™ÃƒÂ¢Ã¢â€šÂ¬Ã‚Â ÃƒÆ’Ã‚Â¢ÃƒÂ¢Ã¢â‚¬Å¡Ã‚Â¬ÃƒÂ¢Ã¢â‚¬Å¾Ã‚Â¢ÃƒÆ’Ã†â€™Ãƒâ€ Ã¢â‚¬â„¢ÃƒÆ’Ã‚Â¢ÃƒÂ¢Ã¢â‚¬Å¡Ã‚Â¬Ãƒâ€šÃ‚Â ÃƒÆ’Ã†â€™Ãƒâ€šÃ‚Â¢ÃƒÆ’Ã‚Â¢ÃƒÂ¢Ã¢â€šÂ¬Ã…Â¡Ãƒâ€šÃ‚Â¬ÃƒÆ’Ã‚Â¢ÃƒÂ¢Ã¢â€šÂ¬Ã…Â¾Ãƒâ€šÃ‚Â¢ÃƒÆ’Ã†â€™Ãƒâ€ Ã¢â‚¬â„¢ÃƒÆ’Ã¢â‚¬Â ÃƒÂ¢Ã¢â€šÂ¬Ã¢â€žÂ¢ÃƒÆ’Ã†â€™Ãƒâ€šÃ‚Â¢ÃƒÆ’Ã‚Â¢ÃƒÂ¢Ã¢â€šÂ¬Ã…Â¡Ãƒâ€šÃ‚Â¬ÃƒÆ’Ã¢â‚¬Â¦Ãƒâ€šÃ‚Â¡ÃƒÆ’Ã†â€™Ãƒâ€ Ã¢â‚¬â„¢ÃƒÆ’Ã‚Â¢ÃƒÂ¢Ã¢â‚¬Å¡Ã‚Â¬Ãƒâ€¦Ã‚Â¡ÃƒÆ’Ã†â€™ÃƒÂ¢Ã¢â€šÂ¬Ã…Â¡ÃƒÆ’Ã¢â‚¬Å¡Ãƒâ€šÃ‚Â¢ÃƒÆ’Ã†â€™Ãƒâ€ Ã¢â‚¬â„¢ÃƒÆ’Ã¢â‚¬Â ÃƒÂ¢Ã¢â€šÂ¬Ã¢â€žÂ¢ÃƒÆ’Ã†â€™ÃƒÂ¢Ã¢â€šÂ¬Ã‚Â ÃƒÆ’Ã‚Â¢ÃƒÂ¢Ã¢â‚¬Å¡Ã‚Â¬ÃƒÂ¢Ã¢â‚¬Å¾Ã‚Â¢ÃƒÆ’Ã†â€™Ãƒâ€ Ã¢â‚¬â„¢ÃƒÆ’Ã‚Â¢ÃƒÂ¢Ã¢â‚¬Å¡Ã‚Â¬Ãƒâ€¦Ã‚Â¡ÃƒÆ’Ã†â€™ÃƒÂ¢Ã¢â€šÂ¬Ã…Â¡ÃƒÆ’Ã¢â‚¬Å¡Ãƒâ€šÃ‚Â¢ÃƒÆ’Ã†â€™Ãƒâ€ Ã¢â‚¬â„¢ÃƒÆ’Ã¢â‚¬Â ÃƒÂ¢Ã¢â€šÂ¬Ã¢â€žÂ¢ÃƒÆ’Ã†â€™ÃƒÂ¢Ã¢â€šÂ¬Ã…Â¡ÃƒÆ’Ã¢â‚¬Å¡Ãƒâ€šÃ‚Â¢ÃƒÆ’Ã†â€™Ãƒâ€ Ã¢â‚¬â„¢ÃƒÆ’Ã¢â‚¬Å¡Ãƒâ€šÃ‚Â¢ÃƒÆ’Ã†â€™Ãƒâ€šÃ‚Â¢ÃƒÆ’Ã‚Â¢ÃƒÂ¢Ã¢â‚¬Å¡Ã‚Â¬Ãƒâ€¦Ã‚Â¡ÃƒÆ’Ã¢â‚¬Å¡Ãƒâ€šÃ‚Â¬ÃƒÆ’Ã†â€™ÃƒÂ¢Ã¢â€šÂ¬Ã‚Â¦ÃƒÆ’Ã¢â‚¬Å¡Ãƒâ€šÃ‚Â¡ÃƒÆ’Ã†â€™Ãƒâ€ Ã¢â‚¬â„¢ÃƒÆ’Ã‚Â¢ÃƒÂ¢Ã¢â‚¬Å¡Ã‚Â¬Ãƒâ€¦Ã‚Â¡ÃƒÆ’Ã†â€™ÃƒÂ¢Ã¢â€šÂ¬Ã…Â¡ÃƒÆ’Ã¢â‚¬Å¡Ãƒâ€šÃ‚Â¬ÃƒÆ’Ã†â€™Ãƒâ€ Ã¢â‚¬â„¢ÃƒÆ’Ã¢â‚¬Â ÃƒÂ¢Ã¢â€šÂ¬Ã¢â€žÂ¢ÃƒÆ’Ã†â€™Ãƒâ€šÃ‚Â¢ÃƒÆ’Ã‚Â¢ÃƒÂ¢Ã¢â€šÂ¬Ã…Â¡Ãƒâ€šÃ‚Â¬ÃƒÆ’Ã¢â‚¬Å¡Ãƒâ€šÃ‚Â¦ÃƒÆ’Ã†â€™Ãƒâ€ Ã¢â‚¬â„¢ÃƒÆ’Ã‚Â¢ÃƒÂ¢Ã¢â‚¬Å¡Ã‚Â¬Ãƒâ€¦Ã‚Â¡ÃƒÆ’Ã†â€™ÃƒÂ¢Ã¢â€šÂ¬Ã…Â¡ÃƒÆ’Ã¢â‚¬Å¡Ãƒâ€šÃ‚Â¡ÃƒÆ’Ã†â€™Ãƒâ€ Ã¢â‚¬â„¢ÃƒÆ’Ã¢â‚¬Â ÃƒÂ¢Ã¢â€šÂ¬Ã¢â€žÂ¢ÃƒÆ’Ã†â€™ÃƒÂ¢Ã¢â€šÂ¬Ã‚Â ÃƒÆ’Ã‚Â¢ÃƒÂ¢Ã¢â‚¬Å¡Ã‚Â¬ÃƒÂ¢Ã¢â‚¬Å¾Ã‚Â¢ÃƒÆ’Ã†â€™Ãƒâ€ Ã¢â‚¬â„¢ÃƒÆ’Ã¢â‚¬Å¡Ãƒâ€šÃ‚Â¢ÃƒÆ’Ã†â€™Ãƒâ€šÃ‚Â¢ÃƒÆ’Ã‚Â¢ÃƒÂ¢Ã¢â‚¬Å¡Ã‚Â¬Ãƒâ€¦Ã‚Â¡ÃƒÆ’Ã¢â‚¬Å¡Ãƒâ€šÃ‚Â¬ÃƒÆ’Ã†â€™ÃƒÂ¢Ã¢â€šÂ¬Ã‚Â¦ÃƒÆ’Ã¢â‚¬Å¡Ãƒâ€šÃ‚Â¡ÃƒÆ’Ã†â€™Ãƒâ€ Ã¢â‚¬â„¢ÃƒÆ’Ã¢â‚¬Â ÃƒÂ¢Ã¢â€šÂ¬Ã¢â€žÂ¢ÃƒÆ’Ã†â€™Ãƒâ€šÃ‚Â¢ÃƒÆ’Ã‚Â¢ÃƒÂ¢Ã¢â€šÂ¬Ã…Â¡Ãƒâ€šÃ‚Â¬ÃƒÆ’Ã¢â‚¬Â¦Ãƒâ€šÃ‚Â¡ÃƒÆ’Ã†â€™Ãƒâ€ Ã¢â‚¬â„¢ÃƒÆ’Ã‚Â¢ÃƒÂ¢Ã¢â‚¬Å¡Ã‚Â¬Ãƒâ€¦Ã‚Â¡ÃƒÆ’Ã†â€™ÃƒÂ¢Ã¢â€šÂ¬Ã…Â¡ÃƒÆ’Ã¢â‚¬Å¡Ãƒâ€šÃ‚Â¬ÃƒÆ’Ã†â€™Ãƒâ€ Ã¢â‚¬â„¢ÃƒÆ’Ã¢â‚¬Â ÃƒÂ¢Ã¢â€šÂ¬Ã¢â€žÂ¢ÃƒÆ’Ã†â€™ÃƒÂ¢Ã¢â€šÂ¬Ã‚Â ÃƒÆ’Ã‚Â¢ÃƒÂ¢Ã¢â‚¬Å¡Ã‚Â¬ÃƒÂ¢Ã¢â‚¬Å¾Ã‚Â¢ÃƒÆ’Ã†â€™Ãƒâ€ Ã¢â‚¬â„¢ÃƒÆ’Ã‚Â¢ÃƒÂ¢Ã¢â‚¬Å¡Ã‚Â¬Ãƒâ€šÃ‚Â ÃƒÆ’Ã†â€™Ãƒâ€šÃ‚Â¢ÃƒÆ’Ã‚Â¢ÃƒÂ¢Ã¢â€šÂ¬Ã…Â¡Ãƒâ€šÃ‚Â¬ÃƒÆ’Ã‚Â¢ÃƒÂ¢Ã¢â€šÂ¬Ã…Â¾Ãƒâ€šÃ‚Â¢ÃƒÆ’Ã†â€™Ãƒâ€ Ã¢â‚¬â„¢ÃƒÆ’Ã¢â‚¬Â ÃƒÂ¢Ã¢â€šÂ¬Ã¢â€žÂ¢ÃƒÆ’Ã†â€™Ãƒâ€šÃ‚Â¢ÃƒÆ’Ã‚Â¢ÃƒÂ¢Ã¢â€šÂ¬Ã…Â¡Ãƒâ€šÃ‚Â¬ÃƒÆ’Ã¢â‚¬Â¦Ãƒâ€šÃ‚Â¡ÃƒÆ’Ã†â€™Ãƒâ€ Ã¢â‚¬â„¢ÃƒÆ’Ã‚Â¢ÃƒÂ¢Ã¢â‚¬Å¡Ã‚Â¬Ãƒâ€¦Ã‚Â¡ÃƒÆ’Ã†â€™ÃƒÂ¢Ã¢â€šÂ¬Ã…Â¡ÃƒÆ’Ã¢â‚¬Å¡Ãƒâ€šÃ‚Â¢ÃƒÆ’Ã†â€™Ãƒâ€ Ã¢â‚¬â„¢ÃƒÆ’Ã¢â‚¬Â ÃƒÂ¢Ã¢â€šÂ¬Ã¢â€žÂ¢ÃƒÆ’Ã†â€™ÃƒÂ¢Ã¢â€šÂ¬Ã‚Â ÃƒÆ’Ã‚Â¢ÃƒÂ¢Ã¢â‚¬Å¡Ã‚Â¬ÃƒÂ¢Ã¢â‚¬Å¾Ã‚Â¢ÃƒÆ’Ã†â€™Ãƒâ€ Ã¢â‚¬â„¢ÃƒÆ’Ã‚Â¢ÃƒÂ¢Ã¢â‚¬Å¡Ã‚Â¬Ãƒâ€¦Ã‚Â¡ÃƒÆ’Ã†â€™ÃƒÂ¢Ã¢â€šÂ¬Ã…Â¡ÃƒÆ’Ã¢â‚¬Å¡Ãƒâ€šÃ‚Â¢ÃƒÆ’Ã†â€™Ãƒâ€ Ã¢â‚¬â„¢ÃƒÆ’Ã¢â‚¬Â ÃƒÂ¢Ã¢â€šÂ¬Ã¢â€žÂ¢ÃƒÆ’Ã†â€™ÃƒÂ¢Ã¢â€šÂ¬Ã…Â¡ÃƒÆ’Ã¢â‚¬Å¡Ãƒâ€šÃ‚Â¢ÃƒÆ’Ã†â€™Ãƒâ€ Ã¢â‚¬â„¢ÃƒÆ’Ã¢â‚¬Å¡Ãƒâ€šÃ‚Â¢ÃƒÆ’Ã†â€™Ãƒâ€šÃ‚Â¢ÃƒÆ’Ã‚Â¢ÃƒÂ¢Ã¢â‚¬Å¡Ã‚Â¬Ãƒâ€¦Ã‚Â¡ÃƒÆ’Ã¢â‚¬Å¡Ãƒâ€šÃ‚Â¬ÃƒÆ’Ã†â€™ÃƒÂ¢Ã¢â€šÂ¬Ã‚Â¦ÃƒÆ’Ã¢â‚¬Å¡Ãƒâ€šÃ‚Â¡ÃƒÆ’Ã†â€™Ãƒâ€ Ã¢â‚¬â„¢ÃƒÆ’Ã‚Â¢ÃƒÂ¢Ã¢â‚¬Å¡Ã‚Â¬Ãƒâ€¦Ã‚Â¡ÃƒÆ’Ã†â€™ÃƒÂ¢Ã¢â€šÂ¬Ã…Â¡ÃƒÆ’Ã¢â‚¬Å¡Ãƒâ€šÃ‚Â¬ÃƒÆ’Ã†â€™Ãƒâ€ Ã¢â‚¬â„¢ÃƒÆ’Ã¢â‚¬Â ÃƒÂ¢Ã¢â€šÂ¬Ã¢â€žÂ¢ÃƒÆ’Ã†â€™Ãƒâ€šÃ‚Â¢ÃƒÆ’Ã‚Â¢ÃƒÂ¢Ã¢â€šÂ¬Ã…Â¡Ãƒâ€šÃ‚Â¬ÃƒÆ’Ã¢â‚¬Å¡Ãƒâ€šÃ‚Â¦ÃƒÆ’Ã†â€™Ãƒâ€ Ã¢â‚¬â„¢ÃƒÆ’Ã‚Â¢ÃƒÂ¢Ã¢â‚¬Å¡Ã‚Â¬Ãƒâ€¦Ã‚Â¡ÃƒÆ’Ã†â€™ÃƒÂ¢Ã¢â€šÂ¬Ã…Â¡ÃƒÆ’Ã¢â‚¬Å¡Ãƒâ€šÃ‚Â¾ÃƒÆ’Ã†â€™Ãƒâ€ Ã¢â‚¬â„¢ÃƒÆ’Ã¢â‚¬Â ÃƒÂ¢Ã¢â€šÂ¬Ã¢â€žÂ¢ÃƒÆ’Ã†â€™ÃƒÂ¢Ã¢â€šÂ¬Ã‚Â ÃƒÆ’Ã‚Â¢ÃƒÂ¢Ã¢â‚¬Å¡Ã‚Â¬ÃƒÂ¢Ã¢â‚¬Å¾Ã‚Â¢ÃƒÆ’Ã†â€™Ãƒâ€ Ã¢â‚¬â„¢ÃƒÆ’Ã¢â‚¬Å¡Ãƒâ€šÃ‚Â¢ÃƒÆ’Ã†â€™Ãƒâ€šÃ‚Â¢ÃƒÆ’Ã‚Â¢ÃƒÂ¢Ã¢â‚¬Å¡Ã‚Â¬Ãƒâ€¦Ã‚Â¡ÃƒÆ’Ã¢â‚¬Å¡Ãƒâ€šÃ‚Â¬ÃƒÆ’Ã†â€™ÃƒÂ¢Ã¢â€šÂ¬Ã‚Â¦ÃƒÆ’Ã¢â‚¬Å¡Ãƒâ€šÃ‚Â¡ÃƒÆ’Ã†â€™Ãƒâ€ Ã¢â‚¬â„¢ÃƒÆ’Ã¢â‚¬Â ÃƒÂ¢Ã¢â€šÂ¬Ã¢â€žÂ¢ÃƒÆ’Ã†â€™Ãƒâ€šÃ‚Â¢ÃƒÆ’Ã‚Â¢ÃƒÂ¢Ã¢â€šÂ¬Ã…Â¡Ãƒâ€šÃ‚Â¬ÃƒÆ’Ã¢â‚¬Â¦Ãƒâ€šÃ‚Â¡ÃƒÆ’Ã†â€™Ãƒâ€ Ã¢â‚¬â„¢ÃƒÆ’Ã‚Â¢ÃƒÂ¢Ã¢â‚¬Å¡Ã‚Â¬Ãƒâ€¦Ã‚Â¡ÃƒÆ’Ã†â€™ÃƒÂ¢Ã¢â€šÂ¬Ã…Â¡ÃƒÆ’Ã¢â‚¬Å¡Ãƒâ€šÃ‚Â¢s t-test Results for </w:t>
+        <w:t xml:space="preserve">Table 2: Descriptive Statistics and WelchÃƒÆ’Ã†â€™Ãƒâ€ Ã¢â‚¬â„¢ÃƒÆ’Ã¢â‚¬Â ÃƒÂ¢Ã¢â€šÂ¬Ã¢â€žÂ¢ÃƒÆ’Ã†â€™ÃƒÂ¢Ã¢â€šÂ¬Ã‚Â ÃƒÆ’Ã‚Â¢ÃƒÂ¢Ã¢â‚¬Å¡Ã‚Â¬ÃƒÂ¢Ã¢â‚¬Å¾Ã‚Â¢ÃƒÆ’Ã†â€™Ãƒâ€ Ã¢â‚¬â„¢ÃƒÆ’Ã‚Â¢ÃƒÂ¢Ã¢â‚¬Å¡Ã‚Â¬Ãƒâ€šÃ‚Â ÃƒÆ’Ã†â€™Ãƒâ€šÃ‚Â¢ÃƒÆ’Ã‚Â¢ÃƒÂ¢Ã¢â€šÂ¬Ã…Â¡Ãƒâ€šÃ‚Â¬ÃƒÆ’Ã‚Â¢ÃƒÂ¢Ã¢â€šÂ¬Ã…Â¾Ãƒâ€šÃ‚Â¢ÃƒÆ’Ã†â€™Ãƒâ€ Ã¢â‚¬â„¢ÃƒÆ’Ã¢â‚¬Â ÃƒÂ¢Ã¢â€šÂ¬Ã¢â€žÂ¢ÃƒÆ’Ã†â€™Ãƒâ€šÃ‚Â¢ÃƒÆ’Ã‚Â¢ÃƒÂ¢Ã¢â€šÂ¬Ã…Â¡Ãƒâ€šÃ‚Â¬ÃƒÆ’Ã¢â‚¬Å¡Ãƒâ€šÃ‚Â ÃƒÆ’Ã†â€™Ãƒâ€ Ã¢â‚¬â„¢ÃƒÆ’Ã¢â‚¬Å¡Ãƒâ€šÃ‚Â¢ÃƒÆ’Ã†â€™Ãƒâ€šÃ‚Â¢ÃƒÆ’Ã‚Â¢ÃƒÂ¢Ã¢â‚¬Å¡Ã‚Â¬Ãƒâ€¦Ã‚Â¡ÃƒÆ’Ã¢â‚¬Å¡Ãƒâ€šÃ‚Â¬ÃƒÆ’Ã†â€™Ãƒâ€šÃ‚Â¢ÃƒÆ’Ã‚Â¢ÃƒÂ¢Ã¢â‚¬Å¡Ã‚Â¬Ãƒâ€¦Ã‚Â¾ÃƒÆ’Ã¢â‚¬Å¡Ãƒâ€šÃ‚Â¢ÃƒÆ’Ã†â€™Ãƒâ€ Ã¢â‚¬â„¢ÃƒÆ’Ã¢â‚¬Â ÃƒÂ¢Ã¢â€šÂ¬Ã¢â€žÂ¢ÃƒÆ’Ã†â€™ÃƒÂ¢Ã¢â€šÂ¬Ã‚Â ÃƒÆ’Ã‚Â¢ÃƒÂ¢Ã¢â‚¬Å¡Ã‚Â¬ÃƒÂ¢Ã¢â‚¬Å¾Ã‚Â¢ÃƒÆ’Ã†â€™Ãƒâ€ Ã¢â‚¬â„¢ÃƒÆ’Ã¢â‚¬Å¡Ãƒâ€šÃ‚Â¢ÃƒÆ’Ã†â€™Ãƒâ€šÃ‚Â¢ÃƒÆ’Ã‚Â¢ÃƒÂ¢Ã¢â‚¬Å¡Ã‚Â¬Ãƒâ€¦Ã‚Â¡ÃƒÆ’Ã¢â‚¬Å¡Ãƒâ€šÃ‚Â¬ÃƒÆ’Ã†â€™ÃƒÂ¢Ã¢â€šÂ¬Ã…Â¡ÃƒÆ’Ã¢â‚¬Å¡Ãƒâ€šÃ‚Â ÃƒÆ’Ã†â€™Ãƒâ€ Ã¢â‚¬â„¢ÃƒÆ’Ã¢â‚¬Â ÃƒÂ¢Ã¢â€šÂ¬Ã¢â€žÂ¢ÃƒÆ’Ã†â€™ÃƒÂ¢Ã¢â€šÂ¬Ã…Â¡ÃƒÆ’Ã¢â‚¬Å¡Ãƒâ€šÃ‚Â¢ÃƒÆ’Ã†â€™Ãƒâ€ Ã¢â‚¬â„¢ÃƒÆ’Ã¢â‚¬Å¡Ãƒâ€šÃ‚Â¢ÃƒÆ’Ã†â€™Ãƒâ€šÃ‚Â¢ÃƒÆ’Ã‚Â¢ÃƒÂ¢Ã¢â€šÂ¬Ã…Â¡Ãƒâ€šÃ‚Â¬ÃƒÆ’Ã¢â‚¬Â¦Ãƒâ€šÃ‚Â¡ÃƒÆ’Ã†â€™ÃƒÂ¢Ã¢â€šÂ¬Ã…Â¡ÃƒÆ’Ã¢â‚¬Å¡Ãƒâ€šÃ‚Â¬ÃƒÆ’Ã†â€™Ãƒâ€ Ã¢â‚¬â„¢ÃƒÆ’Ã¢â‚¬Å¡Ãƒâ€šÃ‚Â¢ÃƒÆ’Ã†â€™Ãƒâ€šÃ‚Â¢ÃƒÆ’Ã‚Â¢ÃƒÂ¢Ã¢â€šÂ¬Ã…Â¡Ãƒâ€šÃ‚Â¬ÃƒÆ’Ã¢â‚¬Â¦Ãƒâ€šÃ‚Â¾ÃƒÆ’Ã†â€™ÃƒÂ¢Ã¢â€šÂ¬Ã…Â¡ÃƒÆ’Ã¢â‚¬Å¡Ãƒâ€šÃ‚Â¢ÃƒÆ’Ã†â€™Ãƒâ€ Ã¢â‚¬â„¢ÃƒÆ’Ã¢â‚¬Â ÃƒÂ¢Ã¢â€šÂ¬Ã¢â€žÂ¢ÃƒÆ’Ã†â€™ÃƒÂ¢Ã¢â€šÂ¬Ã‚Â ÃƒÆ’Ã‚Â¢ÃƒÂ¢Ã¢â‚¬Å¡Ã‚Â¬ÃƒÂ¢Ã¢â‚¬Å¾Ã‚Â¢ÃƒÆ’Ã†â€™Ãƒâ€ Ã¢â‚¬â„¢ÃƒÆ’Ã‚Â¢ÃƒÂ¢Ã¢â‚¬Å¡Ã‚Â¬Ãƒâ€šÃ‚Â ÃƒÆ’Ã†â€™Ãƒâ€šÃ‚Â¢ÃƒÆ’Ã‚Â¢ÃƒÂ¢Ã¢â€šÂ¬Ã…Â¡Ãƒâ€šÃ‚Â¬ÃƒÆ’Ã‚Â¢ÃƒÂ¢Ã¢â€šÂ¬Ã…Â¾Ãƒâ€šÃ‚Â¢ÃƒÆ’Ã†â€™Ãƒâ€ Ã¢â‚¬â„¢ÃƒÆ’Ã¢â‚¬Â ÃƒÂ¢Ã¢â€šÂ¬Ã¢â€žÂ¢ÃƒÆ’Ã†â€™ÃƒÂ¢Ã¢â€šÂ¬Ã…Â¡ÃƒÆ’Ã¢â‚¬Å¡Ãƒâ€šÃ‚Â¢ÃƒÆ’Ã†â€™Ãƒâ€ Ã¢â‚¬â„¢ÃƒÆ’Ã¢â‚¬Å¡Ãƒâ€šÃ‚Â¢ÃƒÆ’Ã†â€™Ãƒâ€šÃ‚Â¢ÃƒÆ’Ã‚Â¢ÃƒÂ¢Ã¢â€šÂ¬Ã…Â¡Ãƒâ€šÃ‚Â¬ÃƒÆ’Ã¢â‚¬Â¦Ãƒâ€šÃ‚Â¡ÃƒÆ’Ã†â€™ÃƒÂ¢Ã¢â€šÂ¬Ã…Â¡ÃƒÆ’Ã¢â‚¬Å¡Ãƒâ€šÃ‚Â¬ÃƒÆ’Ã†â€™Ãƒâ€ Ã¢â‚¬â„¢ÃƒÆ’Ã‚Â¢ÃƒÂ¢Ã¢â‚¬Å¡Ã‚Â¬Ãƒâ€šÃ‚Â¦ÃƒÆ’Ã†â€™ÃƒÂ¢Ã¢â€šÂ¬Ã…Â¡ÃƒÆ’Ã¢â‚¬Å¡Ãƒâ€šÃ‚Â¡ÃƒÆ’Ã†â€™Ãƒâ€ Ã¢â‚¬â„¢ÃƒÆ’Ã¢â‚¬Â ÃƒÂ¢Ã¢â€šÂ¬Ã¢â€žÂ¢ÃƒÆ’Ã†â€™ÃƒÂ¢Ã¢â€šÂ¬Ã‚Â ÃƒÆ’Ã‚Â¢ÃƒÂ¢Ã¢â‚¬Å¡Ã‚Â¬ÃƒÂ¢Ã¢â‚¬Å¾Ã‚Â¢ÃƒÆ’Ã†â€™Ãƒâ€ Ã¢â‚¬â„¢ÃƒÆ’Ã¢â‚¬Å¡Ãƒâ€šÃ‚Â¢ÃƒÆ’Ã†â€™Ãƒâ€šÃ‚Â¢ÃƒÆ’Ã‚Â¢ÃƒÂ¢Ã¢â‚¬Å¡Ã‚Â¬Ãƒâ€¦Ã‚Â¡ÃƒÆ’Ã¢â‚¬Å¡Ãƒâ€šÃ‚Â¬ÃƒÆ’Ã†â€™ÃƒÂ¢Ã¢â€šÂ¬Ã‚Â¦ÃƒÆ’Ã¢â‚¬Å¡Ãƒâ€šÃ‚Â¡ÃƒÆ’Ã†â€™Ãƒâ€ Ã¢â‚¬â„¢ÃƒÆ’Ã¢â‚¬Â ÃƒÂ¢Ã¢â€šÂ¬Ã¢â€žÂ¢ÃƒÆ’Ã†â€™Ãƒâ€šÃ‚Â¢ÃƒÆ’Ã‚Â¢ÃƒÂ¢Ã¢â€šÂ¬Ã…Â¡Ãƒâ€šÃ‚Â¬ÃƒÆ’Ã¢â‚¬Â¦Ãƒâ€šÃ‚Â¡ÃƒÆ’Ã†â€™Ãƒâ€ Ã¢â‚¬â„¢ÃƒÆ’Ã‚Â¢ÃƒÂ¢Ã¢â‚¬Å¡Ã‚Â¬Ãƒâ€¦Ã‚Â¡ÃƒÆ’Ã†â€™ÃƒÂ¢Ã¢â€šÂ¬Ã…Â¡ÃƒÆ’Ã¢â‚¬Å¡Ãƒâ€šÃ‚Â¢ÃƒÆ’Ã†â€™Ãƒâ€ Ã¢â‚¬â„¢ÃƒÆ’Ã¢â‚¬Â ÃƒÂ¢Ã¢â€šÂ¬Ã¢â€žÂ¢ÃƒÆ’Ã†â€™ÃƒÂ¢Ã¢â€šÂ¬Ã‚Â ÃƒÆ’Ã‚Â¢ÃƒÂ¢Ã¢â‚¬Å¡Ã‚Â¬ÃƒÂ¢Ã¢â‚¬Å¾Ã‚Â¢ÃƒÆ’Ã†â€™Ãƒâ€ Ã¢â‚¬â„¢ÃƒÆ’Ã‚Â¢ÃƒÂ¢Ã¢â‚¬Å¡Ã‚Â¬Ãƒâ€šÃ‚Â ÃƒÆ’Ã†â€™Ãƒâ€šÃ‚Â¢ÃƒÆ’Ã‚Â¢ÃƒÂ¢Ã¢â€šÂ¬Ã…Â¡Ãƒâ€šÃ‚Â¬ÃƒÆ’Ã‚Â¢ÃƒÂ¢Ã¢â€šÂ¬Ã…Â¾Ãƒâ€šÃ‚Â¢ÃƒÆ’Ã†â€™Ãƒâ€ Ã¢â‚¬â„¢ÃƒÆ’Ã¢â‚¬Â ÃƒÂ¢Ã¢â€šÂ¬Ã¢â€žÂ¢ÃƒÆ’Ã†â€™Ãƒâ€šÃ‚Â¢ÃƒÆ’Ã‚Â¢ÃƒÂ¢Ã¢â€šÂ¬Ã…Â¡Ãƒâ€šÃ‚Â¬ÃƒÆ’Ã¢â‚¬Å¡Ãƒâ€šÃ‚Â ÃƒÆ’Ã†â€™Ãƒâ€ Ã¢â‚¬â„¢ÃƒÆ’Ã¢â‚¬Å¡Ãƒâ€šÃ‚Â¢ÃƒÆ’Ã†â€™Ãƒâ€šÃ‚Â¢ÃƒÆ’Ã‚Â¢ÃƒÂ¢Ã¢â‚¬Å¡Ã‚Â¬Ãƒâ€¦Ã‚Â¡ÃƒÆ’Ã¢â‚¬Å¡Ãƒâ€šÃ‚Â¬ÃƒÆ’Ã†â€™Ãƒâ€šÃ‚Â¢ÃƒÆ’Ã‚Â¢ÃƒÂ¢Ã¢â‚¬Å¡Ã‚Â¬Ãƒâ€¦Ã‚Â¾ÃƒÆ’Ã¢â‚¬Å¡Ãƒâ€šÃ‚Â¢ÃƒÆ’Ã†â€™Ãƒâ€ Ã¢â‚¬â„¢ÃƒÆ’Ã¢â‚¬Â ÃƒÂ¢Ã¢â€šÂ¬Ã¢â€žÂ¢ÃƒÆ’Ã†â€™ÃƒÂ¢Ã¢â€šÂ¬Ã‚Â ÃƒÆ’Ã‚Â¢ÃƒÂ¢Ã¢â‚¬Å¡Ã‚Â¬ÃƒÂ¢Ã¢â‚¬Å¾Ã‚Â¢ÃƒÆ’Ã†â€™Ãƒâ€ Ã¢â‚¬â„¢ÃƒÆ’Ã¢â‚¬Å¡Ãƒâ€šÃ‚Â¢ÃƒÆ’Ã†â€™Ãƒâ€šÃ‚Â¢ÃƒÆ’Ã‚Â¢ÃƒÂ¢Ã¢â‚¬Å¡Ã‚Â¬Ãƒâ€¦Ã‚Â¡ÃƒÆ’Ã¢â‚¬Å¡Ãƒâ€šÃ‚Â¬ÃƒÆ’Ã†â€™ÃƒÂ¢Ã¢â€šÂ¬Ã‚Â¦ÃƒÆ’Ã¢â‚¬Å¡Ãƒâ€šÃ‚Â¡ÃƒÆ’Ã†â€™Ãƒâ€ Ã¢â‚¬â„¢ÃƒÆ’Ã¢â‚¬Â ÃƒÂ¢Ã¢â€šÂ¬Ã¢â€žÂ¢ÃƒÆ’Ã†â€™Ãƒâ€šÃ‚Â¢ÃƒÆ’Ã‚Â¢ÃƒÂ¢Ã¢â€šÂ¬Ã…Â¡Ãƒâ€šÃ‚Â¬ÃƒÆ’Ã¢â‚¬Â¦Ãƒâ€šÃ‚Â¡ÃƒÆ’Ã†â€™Ãƒâ€ Ã¢â‚¬â„¢ÃƒÆ’Ã‚Â¢ÃƒÂ¢Ã¢â‚¬Å¡Ã‚Â¬Ãƒâ€¦Ã‚Â¡ÃƒÆ’Ã†â€™ÃƒÂ¢Ã¢â€šÂ¬Ã…Â¡ÃƒÆ’Ã¢â‚¬Å¡Ãƒâ€šÃ‚Â¢ÃƒÆ’Ã†â€™Ãƒâ€ Ã¢â‚¬â„¢ÃƒÆ’Ã¢â‚¬Â ÃƒÂ¢Ã¢â€šÂ¬Ã¢â€žÂ¢ÃƒÆ’Ã†â€™ÃƒÂ¢Ã¢â€šÂ¬Ã‚Â ÃƒÆ’Ã‚Â¢ÃƒÂ¢Ã¢â‚¬Å¡Ã‚Â¬ÃƒÂ¢Ã¢â‚¬Å¾Ã‚Â¢ÃƒÆ’Ã†â€™Ãƒâ€ Ã¢â‚¬â„¢ÃƒÆ’Ã‚Â¢ÃƒÂ¢Ã¢â‚¬Å¡Ã‚Â¬Ãƒâ€šÃ‚Â ÃƒÆ’Ã†â€™Ãƒâ€šÃ‚Â¢ÃƒÆ’Ã‚Â¢ÃƒÂ¢Ã¢â€šÂ¬Ã…Â¡Ãƒâ€šÃ‚Â¬ÃƒÆ’Ã‚Â¢ÃƒÂ¢Ã¢â€šÂ¬Ã…Â¾Ãƒâ€šÃ‚Â¢ÃƒÆ’Ã†â€™Ãƒâ€ Ã¢â‚¬â„¢ÃƒÆ’Ã¢â‚¬Â ÃƒÂ¢Ã¢â€šÂ¬Ã¢â€žÂ¢ÃƒÆ’Ã†â€™Ãƒâ€šÃ‚Â¢ÃƒÆ’Ã‚Â¢ÃƒÂ¢Ã¢â€šÂ¬Ã…Â¡Ãƒâ€šÃ‚Â¬ÃƒÆ’Ã¢â‚¬Â¦Ãƒâ€šÃ‚Â¡ÃƒÆ’Ã†â€™Ãƒâ€ Ã¢â‚¬â„¢ÃƒÆ’Ã‚Â¢ÃƒÂ¢Ã¢â‚¬Å¡Ã‚Â¬Ãƒâ€¦Ã‚Â¡ÃƒÆ’Ã†â€™ÃƒÂ¢Ã¢â€šÂ¬Ã…Â¡ÃƒÆ’Ã¢â‚¬Å¡Ãƒâ€šÃ‚Â¢ÃƒÆ’Ã†â€™Ãƒâ€ Ã¢â‚¬â„¢ÃƒÆ’Ã¢â‚¬Â ÃƒÂ¢Ã¢â€šÂ¬Ã¢â€žÂ¢ÃƒÆ’Ã†â€™ÃƒÂ¢Ã¢â€šÂ¬Ã‚Â ÃƒÆ’Ã‚Â¢ÃƒÂ¢Ã¢â‚¬Å¡Ã‚Â¬ÃƒÂ¢Ã¢â‚¬Å¾Ã‚Â¢ÃƒÆ’Ã†â€™Ãƒâ€ Ã¢â‚¬â„¢ÃƒÆ’Ã‚Â¢ÃƒÂ¢Ã¢â‚¬Å¡Ã‚Â¬Ãƒâ€¦Ã‚Â¡ÃƒÆ’Ã†â€™ÃƒÂ¢Ã¢â€šÂ¬Ã…Â¡ÃƒÆ’Ã¢â‚¬Å¡Ãƒâ€šÃ‚Â¢ÃƒÆ’Ã†â€™Ãƒâ€ Ã¢â‚¬â„¢ÃƒÆ’Ã¢â‚¬Â ÃƒÂ¢Ã¢â€šÂ¬Ã¢â€žÂ¢ÃƒÆ’Ã†â€™ÃƒÂ¢Ã¢â€šÂ¬Ã…Â¡ÃƒÆ’Ã¢â‚¬Å¡Ãƒâ€šÃ‚Â¢ÃƒÆ’Ã†â€™Ãƒâ€ Ã¢â‚¬â„¢ÃƒÆ’Ã¢â‚¬Å¡Ãƒâ€šÃ‚Â¢ÃƒÆ’Ã†â€™Ãƒâ€šÃ‚Â¢ÃƒÆ’Ã‚Â¢ÃƒÂ¢Ã¢â€šÂ¬Ã…Â¡Ãƒâ€šÃ‚Â¬ÃƒÆ’Ã¢â‚¬Â¦Ãƒâ€šÃ‚Â¡ÃƒÆ’Ã†â€™ÃƒÂ¢Ã¢â€šÂ¬Ã…Â¡ÃƒÆ’Ã¢â‚¬Å¡Ãƒâ€šÃ‚Â¬ÃƒÆ’Ã†â€™Ãƒâ€ Ã¢â‚¬â„¢ÃƒÆ’Ã‚Â¢ÃƒÂ¢Ã¢â‚¬Å¡Ã‚Â¬Ãƒâ€šÃ‚Â¦ÃƒÆ’Ã†â€™ÃƒÂ¢Ã¢â€šÂ¬Ã…Â¡ÃƒÆ’Ã¢â‚¬Å¡Ãƒâ€šÃ‚Â¡ÃƒÆ’Ã†â€™Ãƒâ€ Ã¢â‚¬â„¢ÃƒÆ’Ã¢â‚¬Â ÃƒÂ¢Ã¢â€šÂ¬Ã¢â€žÂ¢ÃƒÆ’Ã†â€™Ãƒâ€šÃ‚Â¢ÃƒÆ’Ã‚Â¢ÃƒÂ¢Ã¢â€šÂ¬Ã…Â¡Ãƒâ€šÃ‚Â¬ÃƒÆ’Ã¢â‚¬Â¦Ãƒâ€šÃ‚Â¡ÃƒÆ’Ã†â€™Ãƒâ€ Ã¢â‚¬â„¢ÃƒÆ’Ã‚Â¢ÃƒÂ¢Ã¢â‚¬Å¡Ã‚Â¬Ãƒâ€¦Ã‚Â¡ÃƒÆ’Ã†â€™ÃƒÂ¢Ã¢â€šÂ¬Ã…Â¡ÃƒÆ’Ã¢â‚¬Å¡Ãƒâ€šÃ‚Â¬ÃƒÆ’Ã†â€™Ãƒâ€ Ã¢â‚¬â„¢ÃƒÆ’Ã¢â‚¬Â ÃƒÂ¢Ã¢â€šÂ¬Ã¢â€žÂ¢ÃƒÆ’Ã†â€™ÃƒÂ¢Ã¢â€šÂ¬Ã‚Â ÃƒÆ’Ã‚Â¢ÃƒÂ¢Ã¢â‚¬Å¡Ã‚Â¬ÃƒÂ¢Ã¢â‚¬Å¾Ã‚Â¢ÃƒÆ’Ã†â€™Ãƒâ€ Ã¢â‚¬â„¢ÃƒÆ’Ã¢â‚¬Å¡Ãƒâ€šÃ‚Â¢ÃƒÆ’Ã†â€™Ãƒâ€šÃ‚Â¢ÃƒÆ’Ã‚Â¢ÃƒÂ¢Ã¢â‚¬Å¡Ã‚Â¬Ãƒâ€¦Ã‚Â¡ÃƒÆ’Ã¢â‚¬Å¡Ãƒâ€šÃ‚Â¬ÃƒÆ’Ã†â€™ÃƒÂ¢Ã¢â€šÂ¬Ã…Â¡ÃƒÆ’Ã¢â‚¬Å¡Ãƒâ€šÃ‚Â¦ÃƒÆ’Ã†â€™Ãƒâ€ Ã¢â‚¬â„¢ÃƒÆ’Ã¢â‚¬Â ÃƒÂ¢Ã¢â€šÂ¬Ã¢â€žÂ¢ÃƒÆ’Ã†â€™Ãƒâ€šÃ‚Â¢ÃƒÆ’Ã‚Â¢ÃƒÂ¢Ã¢â€šÂ¬Ã…Â¡Ãƒâ€šÃ‚Â¬ÃƒÆ’Ã¢â‚¬Â¦Ãƒâ€šÃ‚Â¡ÃƒÆ’Ã†â€™Ãƒâ€ Ã¢â‚¬â„¢ÃƒÆ’Ã‚Â¢ÃƒÂ¢Ã¢â‚¬Å¡Ã‚Â¬Ãƒâ€¦Ã‚Â¡ÃƒÆ’Ã†â€™ÃƒÂ¢Ã¢â€šÂ¬Ã…Â¡ÃƒÆ’Ã¢â‚¬Å¡Ãƒâ€šÃ‚Â¡ÃƒÆ’Ã†â€™Ãƒâ€ Ã¢â‚¬â„¢ÃƒÆ’Ã¢â‚¬Â ÃƒÂ¢Ã¢â€šÂ¬Ã¢â€žÂ¢ÃƒÆ’Ã†â€™ÃƒÂ¢Ã¢â€šÂ¬Ã‚Â ÃƒÆ’Ã‚Â¢ÃƒÂ¢Ã¢â‚¬Å¡Ã‚Â¬ÃƒÂ¢Ã¢â‚¬Å¾Ã‚Â¢ÃƒÆ’Ã†â€™Ãƒâ€ Ã¢â‚¬â„¢ÃƒÆ’Ã‚Â¢ÃƒÂ¢Ã¢â‚¬Å¡Ã‚Â¬Ãƒâ€šÃ‚Â ÃƒÆ’Ã†â€™Ãƒâ€šÃ‚Â¢ÃƒÆ’Ã‚Â¢ÃƒÂ¢Ã¢â€šÂ¬Ã…Â¡Ãƒâ€šÃ‚Â¬ÃƒÆ’Ã‚Â¢ÃƒÂ¢Ã¢â€šÂ¬Ã…Â¾Ãƒâ€šÃ‚Â¢ÃƒÆ’Ã†â€™Ãƒâ€ Ã¢â‚¬â„¢ÃƒÆ’Ã¢â‚¬Â ÃƒÂ¢Ã¢â€šÂ¬Ã¢â€žÂ¢ÃƒÆ’Ã†â€™ÃƒÂ¢Ã¢â€šÂ¬Ã…Â¡ÃƒÆ’Ã¢â‚¬Å¡Ãƒâ€šÃ‚Â¢ÃƒÆ’Ã†â€™Ãƒâ€ Ã¢â‚¬â„¢ÃƒÆ’Ã¢â‚¬Å¡Ãƒâ€šÃ‚Â¢ÃƒÆ’Ã†â€™Ãƒâ€šÃ‚Â¢ÃƒÆ’Ã‚Â¢ÃƒÂ¢Ã¢â€šÂ¬Ã…Â¡Ãƒâ€šÃ‚Â¬ÃƒÆ’Ã¢â‚¬Â¦Ãƒâ€šÃ‚Â¡ÃƒÆ’Ã†â€™ÃƒÂ¢Ã¢â€šÂ¬Ã…Â¡ÃƒÆ’Ã¢â‚¬Å¡Ãƒâ€šÃ‚Â¬ÃƒÆ’Ã†â€™Ãƒâ€ Ã¢â‚¬â„¢ÃƒÆ’Ã‚Â¢ÃƒÂ¢Ã¢â‚¬Å¡Ã‚Â¬Ãƒâ€šÃ‚Â¦ÃƒÆ’Ã†â€™ÃƒÂ¢Ã¢â€šÂ¬Ã…Â¡ÃƒÆ’Ã¢â‚¬Å¡Ãƒâ€šÃ‚Â¡ÃƒÆ’Ã†â€™Ãƒâ€ Ã¢â‚¬â„¢ÃƒÆ’Ã¢â‚¬Â ÃƒÂ¢Ã¢â€šÂ¬Ã¢â€žÂ¢ÃƒÆ’Ã†â€™ÃƒÂ¢Ã¢â€šÂ¬Ã‚Â ÃƒÆ’Ã‚Â¢ÃƒÂ¢Ã¢â‚¬Å¡Ã‚Â¬ÃƒÂ¢Ã¢â‚¬Å¾Ã‚Â¢ÃƒÆ’Ã†â€™Ãƒâ€ Ã¢â‚¬â„¢ÃƒÆ’Ã¢â‚¬Å¡Ãƒâ€šÃ‚Â¢ÃƒÆ’Ã†â€™Ãƒâ€šÃ‚Â¢ÃƒÆ’Ã‚Â¢ÃƒÂ¢Ã¢â‚¬Å¡Ã‚Â¬Ãƒâ€¦Ã‚Â¡ÃƒÆ’Ã¢â‚¬Å¡Ãƒâ€šÃ‚Â¬ÃƒÆ’Ã†â€™ÃƒÂ¢Ã¢â€šÂ¬Ã‚Â¦ÃƒÆ’Ã¢â‚¬Å¡Ãƒâ€šÃ‚Â¡ÃƒÆ’Ã†â€™Ãƒâ€ Ã¢â‚¬â„¢ÃƒÆ’Ã¢â‚¬Â ÃƒÂ¢Ã¢â€šÂ¬Ã¢â€žÂ¢ÃƒÆ’Ã†â€™Ãƒâ€šÃ‚Â¢ÃƒÆ’Ã‚Â¢ÃƒÂ¢Ã¢â€šÂ¬Ã…Â¡Ãƒâ€šÃ‚Â¬ÃƒÆ’Ã¢â‚¬Â¦Ãƒâ€šÃ‚Â¡ÃƒÆ’Ã†â€™Ãƒâ€ Ã¢â‚¬â„¢ÃƒÆ’Ã‚Â¢ÃƒÂ¢Ã¢â‚¬Å¡Ã‚Â¬Ãƒâ€¦Ã‚Â¡ÃƒÆ’Ã†â€™ÃƒÂ¢Ã¢â€šÂ¬Ã…Â¡ÃƒÆ’Ã¢â‚¬Å¡Ãƒâ€šÃ‚Â¬ÃƒÆ’Ã†â€™Ãƒâ€ Ã¢â‚¬â„¢ÃƒÆ’Ã¢â‚¬Â ÃƒÂ¢Ã¢â€šÂ¬Ã¢â€žÂ¢ÃƒÆ’Ã†â€™ÃƒÂ¢Ã¢â€šÂ¬Ã‚Â ÃƒÆ’Ã‚Â¢ÃƒÂ¢Ã¢â‚¬Å¡Ã‚Â¬ÃƒÂ¢Ã¢â‚¬Å¾Ã‚Â¢ÃƒÆ’Ã†â€™Ãƒâ€ Ã¢â‚¬â„¢ÃƒÆ’Ã‚Â¢ÃƒÂ¢Ã¢â‚¬Å¡Ã‚Â¬Ãƒâ€šÃ‚Â ÃƒÆ’Ã†â€™Ãƒâ€šÃ‚Â¢ÃƒÆ’Ã‚Â¢ÃƒÂ¢Ã¢â€šÂ¬Ã…Â¡Ãƒâ€šÃ‚Â¬ÃƒÆ’Ã‚Â¢ÃƒÂ¢Ã¢â€šÂ¬Ã…Â¾Ãƒâ€šÃ‚Â¢ÃƒÆ’Ã†â€™Ãƒâ€ Ã¢â‚¬â„¢ÃƒÆ’Ã¢â‚¬Â ÃƒÂ¢Ã¢â€šÂ¬Ã¢â€žÂ¢ÃƒÆ’Ã†â€™Ãƒâ€šÃ‚Â¢ÃƒÆ’Ã‚Â¢ÃƒÂ¢Ã¢â€šÂ¬Ã…Â¡Ãƒâ€šÃ‚Â¬ÃƒÆ’Ã¢â‚¬Å¡Ãƒâ€šÃ‚Â ÃƒÆ’Ã†â€™Ãƒâ€ Ã¢â‚¬â„¢ÃƒÆ’Ã¢â‚¬Å¡Ãƒâ€šÃ‚Â¢ÃƒÆ’Ã†â€™Ãƒâ€šÃ‚Â¢ÃƒÆ’Ã‚Â¢ÃƒÂ¢Ã¢â‚¬Å¡Ã‚Â¬Ãƒâ€¦Ã‚Â¡ÃƒÆ’Ã¢â‚¬Å¡Ãƒâ€šÃ‚Â¬ÃƒÆ’Ã†â€™Ãƒâ€šÃ‚Â¢ÃƒÆ’Ã‚Â¢ÃƒÂ¢Ã¢â‚¬Å¡Ã‚Â¬Ãƒâ€¦Ã‚Â¾ÃƒÆ’Ã¢â‚¬Å¡Ãƒâ€šÃ‚Â¢ÃƒÆ’Ã†â€™Ãƒâ€ Ã¢â‚¬â„¢ÃƒÆ’Ã¢â‚¬Â ÃƒÂ¢Ã¢â€šÂ¬Ã¢â€žÂ¢ÃƒÆ’Ã†â€™ÃƒÂ¢Ã¢â€šÂ¬Ã‚Â ÃƒÆ’Ã‚Â¢ÃƒÂ¢Ã¢â‚¬Å¡Ã‚Â¬ÃƒÂ¢Ã¢â‚¬Å¾Ã‚Â¢ÃƒÆ’Ã†â€™Ãƒâ€ Ã¢â‚¬â„¢ÃƒÆ’Ã¢â‚¬Å¡Ãƒâ€šÃ‚Â¢ÃƒÆ’Ã†â€™Ãƒâ€šÃ‚Â¢ÃƒÆ’Ã‚Â¢ÃƒÂ¢Ã¢â‚¬Å¡Ã‚Â¬Ãƒâ€¦Ã‚Â¡ÃƒÆ’Ã¢â‚¬Å¡Ãƒâ€šÃ‚Â¬ÃƒÆ’Ã†â€™ÃƒÂ¢Ã¢â€šÂ¬Ã‚Â¦ÃƒÆ’Ã¢â‚¬Å¡Ãƒâ€šÃ‚Â¡ÃƒÆ’Ã†â€™Ãƒâ€ Ã¢â‚¬â„¢ÃƒÆ’Ã¢â‚¬Â ÃƒÂ¢Ã¢â€šÂ¬Ã¢â€žÂ¢ÃƒÆ’Ã†â€™Ãƒâ€šÃ‚Â¢ÃƒÆ’Ã‚Â¢ÃƒÂ¢Ã¢â€šÂ¬Ã…Â¡Ãƒâ€šÃ‚Â¬ÃƒÆ’Ã¢â‚¬Â¦Ãƒâ€šÃ‚Â¡ÃƒÆ’Ã†â€™Ãƒâ€ Ã¢â‚¬â„¢ÃƒÆ’Ã‚Â¢ÃƒÂ¢Ã¢â‚¬Å¡Ã‚Â¬Ãƒâ€¦Ã‚Â¡ÃƒÆ’Ã†â€™ÃƒÂ¢Ã¢â€šÂ¬Ã…Â¡ÃƒÆ’Ã¢â‚¬Å¡Ãƒâ€šÃ‚Â¢ÃƒÆ’Ã†â€™Ãƒâ€ Ã¢â‚¬â„¢ÃƒÆ’Ã¢â‚¬Â ÃƒÂ¢Ã¢â€šÂ¬Ã¢â€žÂ¢ÃƒÆ’Ã†â€™ÃƒÂ¢Ã¢â€šÂ¬Ã‚Â ÃƒÆ’Ã‚Â¢ÃƒÂ¢Ã¢â‚¬Å¡Ã‚Â¬ÃƒÂ¢Ã¢â‚¬Å¾Ã‚Â¢ÃƒÆ’Ã†â€™Ãƒâ€ Ã¢â‚¬â„¢ÃƒÆ’Ã‚Â¢ÃƒÂ¢Ã¢â‚¬Å¡Ã‚Â¬Ãƒâ€šÃ‚Â ÃƒÆ’Ã†â€™Ãƒâ€šÃ‚Â¢ÃƒÆ’Ã‚Â¢ÃƒÂ¢Ã¢â€šÂ¬Ã…Â¡Ãƒâ€šÃ‚Â¬ÃƒÆ’Ã‚Â¢ÃƒÂ¢Ã¢â€šÂ¬Ã…Â¾Ãƒâ€šÃ‚Â¢ÃƒÆ’Ã†â€™Ãƒâ€ Ã¢â‚¬â„¢ÃƒÆ’Ã¢â‚¬Â ÃƒÂ¢Ã¢â€šÂ¬Ã¢â€žÂ¢ÃƒÆ’Ã†â€™Ãƒâ€šÃ‚Â¢ÃƒÆ’Ã‚Â¢ÃƒÂ¢Ã¢â€šÂ¬Ã…Â¡Ãƒâ€šÃ‚Â¬ÃƒÆ’Ã¢â‚¬Â¦Ãƒâ€šÃ‚Â¡ÃƒÆ’Ã†â€™Ãƒâ€ Ã¢â‚¬â„¢ÃƒÆ’Ã‚Â¢ÃƒÂ¢Ã¢â‚¬Å¡Ã‚Â¬Ãƒâ€¦Ã‚Â¡ÃƒÆ’Ã†â€™ÃƒÂ¢Ã¢â€šÂ¬Ã…Â¡ÃƒÆ’Ã¢â‚¬Å¡Ãƒâ€šÃ‚Â¢ÃƒÆ’Ã†â€™Ãƒâ€ Ã¢â‚¬â„¢ÃƒÆ’Ã¢â‚¬Â ÃƒÂ¢Ã¢â€šÂ¬Ã¢â€žÂ¢ÃƒÆ’Ã†â€™ÃƒÂ¢Ã¢â€šÂ¬Ã‚Â ÃƒÆ’Ã‚Â¢ÃƒÂ¢Ã¢â‚¬Å¡Ã‚Â¬ÃƒÂ¢Ã¢â‚¬Å¾Ã‚Â¢ÃƒÆ’Ã†â€™Ãƒâ€ Ã¢â‚¬â„¢ÃƒÆ’Ã‚Â¢ÃƒÂ¢Ã¢â‚¬Å¡Ã‚Â¬Ãƒâ€¦Ã‚Â¡ÃƒÆ’Ã†â€™ÃƒÂ¢Ã¢â€šÂ¬Ã…Â¡ÃƒÆ’Ã¢â‚¬Å¡Ãƒâ€šÃ‚Â¢ÃƒÆ’Ã†â€™Ãƒâ€ Ã¢â‚¬â„¢ÃƒÆ’Ã¢â‚¬Â ÃƒÂ¢Ã¢â€šÂ¬Ã¢â€žÂ¢ÃƒÆ’Ã†â€™ÃƒÂ¢Ã¢â€šÂ¬Ã…Â¡ÃƒÆ’Ã¢â‚¬Å¡Ãƒâ€šÃ‚Â¢ÃƒÆ’Ã†â€™Ãƒâ€ Ã¢â‚¬â„¢ÃƒÆ’Ã¢â‚¬Å¡Ãƒâ€šÃ‚Â¢ÃƒÆ’Ã†â€™Ãƒâ€šÃ‚Â¢ÃƒÆ’Ã‚Â¢ÃƒÂ¢Ã¢â€šÂ¬Ã…Â¡Ãƒâ€šÃ‚Â¬ÃƒÆ’Ã¢â‚¬Â¦Ãƒâ€šÃ‚Â¡ÃƒÆ’Ã†â€™ÃƒÂ¢Ã¢â€šÂ¬Ã…Â¡ÃƒÆ’Ã¢â‚¬Å¡Ãƒâ€šÃ‚Â¬ÃƒÆ’Ã†â€™Ãƒâ€ Ã¢â‚¬â„¢ÃƒÆ’Ã‚Â¢ÃƒÂ¢Ã¢â‚¬Å¡Ã‚Â¬Ãƒâ€šÃ‚Â¦ÃƒÆ’Ã†â€™ÃƒÂ¢Ã¢â€šÂ¬Ã…Â¡ÃƒÆ’Ã¢â‚¬Å¡Ãƒâ€šÃ‚Â¡ÃƒÆ’Ã†â€™Ãƒâ€ Ã¢â‚¬â„¢ÃƒÆ’Ã¢â‚¬Â ÃƒÂ¢Ã¢â€šÂ¬Ã¢â€žÂ¢ÃƒÆ’Ã†â€™Ãƒâ€šÃ‚Â¢ÃƒÆ’Ã‚Â¢ÃƒÂ¢Ã¢â€šÂ¬Ã…Â¡Ãƒâ€šÃ‚Â¬ÃƒÆ’Ã¢â‚¬Â¦Ãƒâ€šÃ‚Â¡ÃƒÆ’Ã†â€™Ãƒâ€ Ã¢â‚¬â„¢ÃƒÆ’Ã‚Â¢ÃƒÂ¢Ã¢â‚¬Å¡Ã‚Â¬Ãƒâ€¦Ã‚Â¡ÃƒÆ’Ã†â€™ÃƒÂ¢Ã¢â€šÂ¬Ã…Â¡ÃƒÆ’Ã¢â‚¬Å¡Ãƒâ€šÃ‚Â¬ÃƒÆ’Ã†â€™Ãƒâ€ Ã¢â‚¬â„¢ÃƒÆ’Ã¢â‚¬Â ÃƒÂ¢Ã¢â€šÂ¬Ã¢â€žÂ¢ÃƒÆ’Ã†â€™ÃƒÂ¢Ã¢â€šÂ¬Ã‚Â ÃƒÆ’Ã‚Â¢ÃƒÂ¢Ã¢â‚¬Å¡Ã‚Â¬ÃƒÂ¢Ã¢â‚¬Å¾Ã‚Â¢ÃƒÆ’Ã†â€™Ãƒâ€ Ã¢â‚¬â„¢ÃƒÆ’Ã¢â‚¬Å¡Ãƒâ€šÃ‚Â¢ÃƒÆ’Ã†â€™Ãƒâ€šÃ‚Â¢ÃƒÆ’Ã‚Â¢ÃƒÂ¢Ã¢â‚¬Å¡Ã‚Â¬Ãƒâ€¦Ã‚Â¡ÃƒÆ’Ã¢â‚¬Å¡Ãƒâ€šÃ‚Â¬ÃƒÆ’Ã†â€™ÃƒÂ¢Ã¢â€šÂ¬Ã…Â¡ÃƒÆ’Ã¢â‚¬Å¡Ãƒâ€šÃ‚Â¦ÃƒÆ’Ã†â€™Ãƒâ€ Ã¢â‚¬â„¢ÃƒÆ’Ã¢â‚¬Â ÃƒÂ¢Ã¢â€šÂ¬Ã¢â€žÂ¢ÃƒÆ’Ã†â€™Ãƒâ€šÃ‚Â¢ÃƒÆ’Ã‚Â¢ÃƒÂ¢Ã¢â€šÂ¬Ã…Â¡Ãƒâ€šÃ‚Â¬ÃƒÆ’Ã¢â‚¬Â¦Ãƒâ€šÃ‚Â¡ÃƒÆ’Ã†â€™Ãƒâ€ Ã¢â‚¬â„¢ÃƒÆ’Ã‚Â¢ÃƒÂ¢Ã¢â‚¬Å¡Ã‚Â¬Ãƒâ€¦Ã‚Â¡ÃƒÆ’Ã†â€™ÃƒÂ¢Ã¢â€šÂ¬Ã…Â¡ÃƒÆ’Ã¢â‚¬Å¡Ãƒâ€šÃ‚Â¾ÃƒÆ’Ã†â€™Ãƒâ€ Ã¢â‚¬â„¢ÃƒÆ’Ã¢â‚¬Â ÃƒÂ¢Ã¢â€šÂ¬Ã¢â€žÂ¢ÃƒÆ’Ã†â€™ÃƒÂ¢Ã¢â€šÂ¬Ã‚Â ÃƒÆ’Ã‚Â¢ÃƒÂ¢Ã¢â‚¬Å¡Ã‚Â¬ÃƒÂ¢Ã¢â‚¬Å¾Ã‚Â¢ÃƒÆ’Ã†â€™Ãƒâ€ Ã¢â‚¬â„¢ÃƒÆ’Ã‚Â¢ÃƒÂ¢Ã¢â‚¬Å¡Ã‚Â¬Ãƒâ€šÃ‚Â ÃƒÆ’Ã†â€™Ãƒâ€šÃ‚Â¢ÃƒÆ’Ã‚Â¢ÃƒÂ¢Ã¢â€šÂ¬Ã…Â¡Ãƒâ€šÃ‚Â¬ÃƒÆ’Ã‚Â¢ÃƒÂ¢Ã¢â€šÂ¬Ã…Â¾Ãƒâ€šÃ‚Â¢ÃƒÆ’Ã†â€™Ãƒâ€ Ã¢â‚¬â„¢ÃƒÆ’Ã¢â‚¬Â ÃƒÂ¢Ã¢â€šÂ¬Ã¢â€žÂ¢ÃƒÆ’Ã†â€™ÃƒÂ¢Ã¢â€šÂ¬Ã…Â¡ÃƒÆ’Ã¢â‚¬Å¡Ãƒâ€šÃ‚Â¢ÃƒÆ’Ã†â€™Ãƒâ€ Ã¢â‚¬â„¢ÃƒÆ’Ã¢â‚¬Å¡Ãƒâ€šÃ‚Â¢ÃƒÆ’Ã†â€™Ãƒâ€šÃ‚Â¢ÃƒÆ’Ã‚Â¢ÃƒÂ¢Ã¢â€šÂ¬Ã…Â¡Ãƒâ€šÃ‚Â¬ÃƒÆ’Ã¢â‚¬Â¦Ãƒâ€šÃ‚Â¡ÃƒÆ’Ã†â€™ÃƒÂ¢Ã¢â€šÂ¬Ã…Â¡ÃƒÆ’Ã¢â‚¬Å¡Ãƒâ€šÃ‚Â¬ÃƒÆ’Ã†â€™Ãƒâ€ Ã¢â‚¬â„¢ÃƒÆ’Ã‚Â¢ÃƒÂ¢Ã¢â‚¬Å¡Ã‚Â¬Ãƒâ€šÃ‚Â¦ÃƒÆ’Ã†â€™ÃƒÂ¢Ã¢â€šÂ¬Ã…Â¡ÃƒÆ’Ã¢â‚¬Å¡Ãƒâ€šÃ‚Â¡ÃƒÆ’Ã†â€™Ãƒâ€ Ã¢â‚¬â„¢ÃƒÆ’Ã¢â‚¬Â ÃƒÂ¢Ã¢â€šÂ¬Ã¢â€žÂ¢ÃƒÆ’Ã†â€™ÃƒÂ¢Ã¢â€šÂ¬Ã‚Â ÃƒÆ’Ã‚Â¢ÃƒÂ¢Ã¢â‚¬Å¡Ã‚Â¬ÃƒÂ¢Ã¢â‚¬Å¾Ã‚Â¢ÃƒÆ’Ã†â€™Ãƒâ€ Ã¢â‚¬â„¢ÃƒÆ’Ã¢â‚¬Å¡Ãƒâ€šÃ‚Â¢ÃƒÆ’Ã†â€™Ãƒâ€šÃ‚Â¢ÃƒÆ’Ã‚Â¢ÃƒÂ¢Ã¢â‚¬Å¡Ã‚Â¬Ãƒâ€¦Ã‚Â¡ÃƒÆ’Ã¢â‚¬Å¡Ãƒâ€šÃ‚Â¬ÃƒÆ’Ã†â€™ÃƒÂ¢Ã¢â€šÂ¬Ã‚Â¦ÃƒÆ’Ã¢â‚¬Å¡Ãƒâ€šÃ‚Â¡ÃƒÆ’Ã†â€™Ãƒâ€ Ã¢â‚¬â„¢ÃƒÆ’Ã¢â‚¬Â ÃƒÂ¢Ã¢â€šÂ¬Ã¢â€žÂ¢ÃƒÆ’Ã†â€™Ãƒâ€šÃ‚Â¢ÃƒÆ’Ã‚Â¢ÃƒÂ¢Ã¢â€šÂ¬Ã…Â¡Ãƒâ€šÃ‚Â¬ÃƒÆ’Ã¢â‚¬Â¦Ãƒâ€šÃ‚Â¡ÃƒÆ’Ã†â€™Ãƒâ€ Ã¢â‚¬â„¢ÃƒÆ’Ã‚Â¢ÃƒÂ¢Ã¢â‚¬Å¡Ã‚Â¬Ãƒâ€¦Ã‚Â¡ÃƒÆ’Ã†â€™ÃƒÂ¢Ã¢â€šÂ¬Ã…Â¡ÃƒÆ’Ã¢â‚¬Å¡Ãƒâ€šÃ‚Â¢s t-test Results for </w:t>
       </w:r>
       <w:r>
         <w:rPr>
@@ -2351,21 +2351,21 @@
         <w:rPr>
           <w:rFonts w:ascii="Times New Roman" w:hAnsi="Times New Roman" w:cs="Times New Roman"/>
         </w:rPr>
-        <w:t xml:space="preserve"> in IMTA and Monoculture systems across four sampling intervals. Overall, both systems show fluctuating growth patterns, including periods of weight loss and recovery. In the early phase (Wk2ÃƒÆ’Ã†â€™Ãƒâ€ Ã¢â‚¬â„¢ÃƒÆ’Ã¢â‚¬Â ÃƒÂ¢Ã¢â€šÂ¬Ã¢â€žÂ¢ÃƒÆ’Ã†â€™ÃƒÂ¢Ã¢â€šÂ¬Ã‚Â ÃƒÆ’Ã‚Â¢ÃƒÂ¢Ã¢â‚¬Å¡Ã‚Â¬ÃƒÂ¢Ã¢â‚¬Å¾Ã‚Â¢ÃƒÆ’Ã†â€™Ãƒâ€ Ã¢â‚¬â„¢ÃƒÆ’Ã‚Â¢ÃƒÂ¢Ã¢â‚¬Å¡Ã‚Â¬Ãƒâ€šÃ‚Â ÃƒÆ’Ã†â€™Ãƒâ€šÃ‚Â¢ÃƒÆ’Ã‚Â¢ÃƒÂ¢Ã¢â€šÂ¬Ã…Â¡Ãƒâ€šÃ‚Â¬ÃƒÆ’Ã‚Â¢ÃƒÂ¢Ã¢â€šÂ¬Ã…Â¾Ãƒâ€šÃ‚Â¢ÃƒÆ’Ã†â€™Ãƒâ€ Ã¢â‚¬â„¢ÃƒÆ’Ã¢â‚¬Â ÃƒÂ¢Ã¢â€šÂ¬Ã¢â€žÂ¢ÃƒÆ’Ã†â€™Ãƒâ€šÃ‚Â¢ÃƒÆ’Ã‚Â¢ÃƒÂ¢Ã¢â€šÂ¬Ã…Â¡Ãƒâ€šÃ‚Â¬ÃƒÆ’Ã¢â‚¬Å¡Ãƒâ€šÃ‚Â ÃƒÆ’Ã†â€™Ãƒâ€ Ã¢â‚¬â„¢ÃƒÆ’Ã¢â‚¬Å¡Ãƒâ€šÃ‚Â¢ÃƒÆ’Ã†â€™Ãƒâ€šÃ‚Â¢ÃƒÆ’Ã‚Â¢ÃƒÂ¢Ã¢â‚¬Å¡Ã‚Â¬Ãƒâ€¦Ã‚Â¡ÃƒÆ’Ã¢â‚¬Å¡Ãƒâ€šÃ‚Â¬ÃƒÆ’Ã†â€™Ãƒâ€šÃ‚Â¢ÃƒÆ’Ã‚Â¢ÃƒÂ¢Ã¢â‚¬Å¡Ã‚Â¬Ãƒâ€¦Ã‚Â¾ÃƒÆ’Ã¢â‚¬Å¡Ãƒâ€šÃ‚Â¢ÃƒÆ’Ã†â€™Ãƒâ€ Ã¢â‚¬â„¢ÃƒÆ’Ã¢â‚¬Â ÃƒÂ¢Ã¢â€šÂ¬Ã¢â€žÂ¢ÃƒÆ’Ã†â€™ÃƒÂ¢Ã¢â€šÂ¬Ã‚Â ÃƒÆ’Ã‚Â¢ÃƒÂ¢Ã¢â‚¬Å¡Ã‚Â¬ÃƒÂ¢Ã¢â‚¬Å¾Ã‚Â¢ÃƒÆ’Ã†â€™Ãƒâ€ Ã¢â‚¬â„¢ÃƒÆ’Ã¢â‚¬Å¡Ãƒâ€šÃ‚Â¢ÃƒÆ’Ã†â€™Ãƒâ€šÃ‚Â¢ÃƒÆ’Ã‚Â¢ÃƒÂ¢Ã¢â‚¬Å¡Ã‚Â¬Ãƒâ€¦Ã‚Â¡ÃƒÆ’Ã¢â‚¬Å¡Ãƒâ€šÃ‚Â¬ÃƒÆ’Ã†â€™ÃƒÂ¢Ã¢â€šÂ¬Ã‚Â¦ÃƒÆ’Ã¢â‚¬Å¡Ãƒâ€šÃ‚Â¡ÃƒÆ’Ã†â€™Ãƒâ€ Ã¢â‚¬â„¢ÃƒÆ’Ã¢â‚¬Â ÃƒÂ¢Ã¢â€šÂ¬Ã¢â€žÂ¢ÃƒÆ’Ã†â€™Ãƒâ€šÃ‚Â¢ÃƒÆ’Ã‚Â¢ÃƒÂ¢Ã¢â€šÂ¬Ã…Â¡Ãƒâ€šÃ‚Â¬ÃƒÆ’Ã¢â‚¬Â¦Ãƒâ€šÃ‚Â¡ÃƒÆ’Ã†â€™Ãƒâ€ Ã¢â‚¬â„¢ÃƒÆ’Ã‚Â¢ÃƒÂ¢Ã¢â‚¬Å¡Ã‚Â¬Ãƒâ€¦Ã‚Â¡ÃƒÆ’Ã†â€™ÃƒÂ¢Ã¢â€šÂ¬Ã…Â¡ÃƒÆ’Ã¢â‚¬Å¡Ãƒâ€šÃ‚Â¢ÃƒÆ’Ã†â€™Ãƒâ€ Ã¢â‚¬â„¢ÃƒÆ’Ã¢â‚¬Â ÃƒÂ¢Ã¢â€šÂ¬Ã¢â€žÂ¢ÃƒÆ’Ã†â€™ÃƒÂ¢Ã¢â€šÂ¬Ã‚Â ÃƒÆ’Ã‚Â¢ÃƒÂ¢Ã¢â‚¬Å¡Ã‚Â¬ÃƒÂ¢Ã¢â‚¬Å¾Ã‚Â¢ÃƒÆ’Ã†â€™Ãƒâ€ Ã¢â‚¬â„¢ÃƒÆ’Ã‚Â¢ÃƒÂ¢Ã¢â‚¬Å¡Ã‚Â¬Ãƒâ€šÃ‚Â ÃƒÆ’Ã†â€™Ãƒâ€šÃ‚Â¢ÃƒÆ’Ã‚Â¢ÃƒÂ¢Ã¢â€šÂ¬Ã…Â¡Ãƒâ€šÃ‚Â¬ÃƒÆ’Ã‚Â¢ÃƒÂ¢Ã¢â€šÂ¬Ã…Â¾Ãƒâ€šÃ‚Â¢ÃƒÆ’Ã†â€™Ãƒâ€ Ã¢â‚¬â„¢ÃƒÆ’Ã¢â‚¬Â ÃƒÂ¢Ã¢â€šÂ¬Ã¢â€žÂ¢ÃƒÆ’Ã†â€™Ãƒâ€šÃ‚Â¢ÃƒÆ’Ã‚Â¢ÃƒÂ¢Ã¢â€šÂ¬Ã…Â¡Ãƒâ€šÃ‚Â¬ÃƒÆ’Ã¢â‚¬Â¦Ãƒâ€šÃ‚Â¡ÃƒÆ’Ã†â€™Ãƒâ€ Ã¢â‚¬â„¢ÃƒÆ’Ã‚Â¢ÃƒÂ¢Ã¢â‚¬Å¡Ã‚Â¬Ãƒâ€¦Ã‚Â¡ÃƒÆ’Ã†â€™ÃƒÂ¢Ã¢â€šÂ¬Ã…Â¡ÃƒÆ’Ã¢â‚¬Å¡Ãƒâ€šÃ‚Â¢ÃƒÆ’Ã†â€™Ãƒâ€ Ã¢â‚¬â„¢ÃƒÆ’Ã¢â‚¬Â ÃƒÂ¢Ã¢â€šÂ¬Ã¢â€žÂ¢ÃƒÆ’Ã†â€™ÃƒÂ¢Ã¢â€šÂ¬Ã‚Â ÃƒÆ’Ã‚Â¢ÃƒÂ¢Ã¢â‚¬Å¡Ã‚Â¬ÃƒÂ¢Ã¢â‚¬Å¾Ã‚Â¢ÃƒÆ’Ã†â€™Ãƒâ€ Ã¢â‚¬â„¢ÃƒÆ’Ã‚Â¢ÃƒÂ¢Ã¢â‚¬Å¡Ã‚Â¬Ãƒâ€¦Ã‚Â¡ÃƒÆ’Ã†â€™ÃƒÂ¢Ã¢â€šÂ¬Ã…Â¡ÃƒÆ’Ã¢â‚¬Å¡Ãƒâ€šÃ‚Â¢ÃƒÆ’Ã†â€™Ãƒâ€ Ã¢â‚¬â„¢ÃƒÆ’Ã¢â‚¬Â ÃƒÂ¢Ã¢â€šÂ¬Ã¢â€žÂ¢ÃƒÆ’Ã†â€™ÃƒÂ¢Ã¢â€šÂ¬Ã…Â¡ÃƒÆ’Ã¢â‚¬Å¡Ãƒâ€šÃ‚Â¢ÃƒÆ’Ã†â€™Ãƒâ€ Ã¢â‚¬â„¢ÃƒÆ’Ã¢â‚¬Å¡Ãƒâ€šÃ‚Â¢ÃƒÆ’Ã†â€™Ãƒâ€šÃ‚Â¢ÃƒÆ’Ã‚Â¢ÃƒÂ¢Ã¢â‚¬Å¡Ã‚Â¬Ãƒâ€¦Ã‚Â¡ÃƒÆ’Ã¢â‚¬Å¡Ãƒâ€šÃ‚Â¬ÃƒÆ’Ã†â€™ÃƒÂ¢Ã¢â€šÂ¬Ã‚Â¦ÃƒÆ’Ã¢â‚¬Å¡Ãƒâ€šÃ‚Â¡ÃƒÆ’Ã†â€™Ãƒâ€ Ã¢â‚¬â„¢ÃƒÆ’Ã‚Â¢ÃƒÂ¢Ã¢â‚¬Å¡Ã‚Â¬Ãƒâ€¦Ã‚Â¡ÃƒÆ’Ã†â€™ÃƒÂ¢Ã¢â€šÂ¬Ã…Â¡ÃƒÆ’Ã¢â‚¬Å¡Ãƒâ€šÃ‚Â¬ÃƒÆ’Ã†â€™Ãƒâ€ Ã¢â‚¬â„¢ÃƒÆ’Ã¢â‚¬Â ÃƒÂ¢Ã¢â€šÂ¬Ã¢â€žÂ¢ÃƒÆ’Ã†â€™Ãƒâ€šÃ‚Â¢ÃƒÆ’Ã‚Â¢ÃƒÂ¢Ã¢â€šÂ¬Ã…Â¡Ãƒâ€šÃ‚Â¬ÃƒÆ’Ã¢â‚¬Å¡Ãƒâ€šÃ‚Â¦ÃƒÆ’Ã†â€™Ãƒâ€ Ã¢â‚¬â„¢ÃƒÆ’Ã‚Â¢ÃƒÂ¢Ã¢â‚¬Å¡Ã‚Â¬Ãƒâ€¦Ã‚Â¡ÃƒÆ’Ã†â€™ÃƒÂ¢Ã¢â€šÂ¬Ã…Â¡ÃƒÆ’Ã¢â‚¬Å¡Ãƒâ€šÃ‚Â¡ÃƒÆ’Ã†â€™Ãƒâ€ Ã¢â‚¬â„¢ÃƒÆ’Ã¢â‚¬Â ÃƒÂ¢Ã¢â€šÂ¬Ã¢â€žÂ¢ÃƒÆ’Ã†â€™ÃƒÂ¢Ã¢â€šÂ¬Ã‚Â ÃƒÆ’Ã‚Â¢ÃƒÂ¢Ã¢â‚¬Å¡Ã‚Â¬ÃƒÂ¢Ã¢â‚¬Å¾Ã‚Â¢ÃƒÆ’Ã†â€™Ãƒâ€ Ã¢â‚¬â„¢ÃƒÆ’Ã¢â‚¬Å¡Ãƒâ€šÃ‚Â¢ÃƒÆ’Ã†â€™Ãƒâ€šÃ‚Â¢ÃƒÆ’Ã‚Â¢ÃƒÂ¢Ã¢â‚¬Å¡Ã‚Â¬Ãƒâ€¦Ã‚Â¡ÃƒÆ’Ã¢â‚¬Å¡Ãƒâ€šÃ‚Â¬ÃƒÆ’Ã†â€™ÃƒÂ¢Ã¢â€šÂ¬Ã‚Â¦ÃƒÆ’Ã¢â‚¬Å¡Ãƒâ€šÃ‚Â¡ÃƒÆ’Ã†â€™Ãƒâ€ Ã¢â‚¬â„¢ÃƒÆ’Ã¢â‚¬Â ÃƒÂ¢Ã¢â€šÂ¬Ã¢â€žÂ¢ÃƒÆ’Ã†â€™Ãƒâ€šÃ‚Â¢ÃƒÆ’Ã‚Â¢ÃƒÂ¢Ã¢â€šÂ¬Ã…Â¡Ãƒâ€šÃ‚Â¬ÃƒÆ’Ã¢â‚¬Â¦Ãƒâ€šÃ‚Â¡ÃƒÆ’Ã†â€™Ãƒâ€ Ã¢â‚¬â„¢ÃƒÆ’Ã‚Â¢ÃƒÂ¢Ã¢â‚¬Å¡Ã‚Â¬Ãƒâ€¦Ã‚Â¡ÃƒÆ’Ã†â€™ÃƒÂ¢Ã¢â€šÂ¬Ã…Â¡ÃƒÆ’Ã¢â‚¬Å¡Ãƒâ€šÃ‚Â¬ÃƒÆ’Ã†â€™Ãƒâ€ Ã¢â‚¬â„¢ÃƒÆ’Ã¢â‚¬Â ÃƒÂ¢Ã¢â€šÂ¬Ã¢â€žÂ¢ÃƒÆ’Ã†â€™ÃƒÂ¢Ã¢â€šÂ¬Ã‚Â ÃƒÆ’Ã‚Â¢ÃƒÂ¢Ã¢â‚¬Å¡Ã‚Â¬ÃƒÂ¢Ã¢â‚¬Å¾Ã‚Â¢ÃƒÆ’Ã†â€™Ãƒâ€ Ã¢â‚¬â„¢ÃƒÆ’Ã‚Â¢ÃƒÂ¢Ã¢â‚¬Å¡Ã‚Â¬Ãƒâ€šÃ‚Â ÃƒÆ’Ã†â€™Ãƒâ€šÃ‚Â¢ÃƒÆ’Ã‚Â¢ÃƒÂ¢Ã¢â€šÂ¬Ã…Â¡Ãƒâ€šÃ‚Â¬ÃƒÆ’Ã‚Â¢ÃƒÂ¢Ã¢â€šÂ¬Ã…Â¾Ãƒâ€šÃ‚Â¢ÃƒÆ’Ã†â€™Ãƒâ€ Ã¢â‚¬â„¢ÃƒÆ’Ã¢â‚¬Â ÃƒÂ¢Ã¢â€šÂ¬Ã¢â€žÂ¢ÃƒÆ’Ã†â€™Ãƒâ€šÃ‚Â¢ÃƒÆ’Ã‚Â¢ÃƒÂ¢Ã¢â€šÂ¬Ã…Â¡Ãƒâ€šÃ‚Â¬ÃƒÆ’Ã¢â‚¬Â¦Ãƒâ€šÃ‚Â¡ÃƒÆ’Ã†â€™Ãƒâ€ Ã¢â‚¬â„¢ÃƒÆ’Ã‚Â¢ÃƒÂ¢Ã¢â‚¬Å¡Ã‚Â¬Ãƒâ€¦Ã‚Â¡ÃƒÆ’Ã†â€™ÃƒÂ¢Ã¢â€šÂ¬Ã…Â¡ÃƒÆ’Ã¢â‚¬Å¡Ãƒâ€šÃ‚Â¢ÃƒÆ’Ã†â€™Ãƒâ€ Ã¢â‚¬â„¢ÃƒÆ’Ã¢â‚¬Â ÃƒÂ¢Ã¢â€šÂ¬Ã¢â€žÂ¢ÃƒÆ’Ã†â€™ÃƒÂ¢Ã¢â€šÂ¬Ã‚Â ÃƒÆ’Ã‚Â¢ÃƒÂ¢Ã¢â‚¬Å¡Ã‚Â¬ÃƒÂ¢Ã¢â‚¬Å¾Ã‚Â¢ÃƒÆ’Ã†â€™Ãƒâ€ Ã¢â‚¬â„¢ÃƒÆ’Ã‚Â¢ÃƒÂ¢Ã¢â‚¬Å¡Ã‚Â¬Ãƒâ€¦Ã‚Â¡ÃƒÆ’Ã†â€™ÃƒÂ¢Ã¢â€šÂ¬Ã…Â¡ÃƒÆ’Ã¢â‚¬Å¡Ãƒâ€šÃ‚Â¢ÃƒÆ’Ã†â€™Ãƒâ€ Ã¢â‚¬â„¢ÃƒÆ’Ã¢â‚¬Â ÃƒÂ¢Ã¢â€šÂ¬Ã¢â€žÂ¢ÃƒÆ’Ã†â€™ÃƒÂ¢Ã¢â€šÂ¬Ã…Â¡ÃƒÆ’Ã¢â‚¬Å¡Ãƒâ€šÃ‚Â¢ÃƒÆ’Ã†â€™Ãƒâ€ Ã¢â‚¬â„¢ÃƒÆ’Ã¢â‚¬Å¡Ãƒâ€šÃ‚Â¢ÃƒÆ’Ã†â€™Ãƒâ€šÃ‚Â¢ÃƒÆ’Ã‚Â¢ÃƒÂ¢Ã¢â€šÂ¬Ã…Â¡Ãƒâ€šÃ‚Â¬ÃƒÆ’Ã¢â‚¬Â¦Ãƒâ€šÃ‚Â¡ÃƒÆ’Ã†â€™ÃƒÂ¢Ã¢â€šÂ¬Ã…Â¡ÃƒÆ’Ã¢â‚¬Å¡Ãƒâ€šÃ‚Â¬ÃƒÆ’Ã†â€™Ãƒâ€ Ã¢â‚¬â„¢ÃƒÆ’Ã‚Â¢ÃƒÂ¢Ã¢â‚¬Å¡Ã‚Â¬Ãƒâ€šÃ‚Â¦ÃƒÆ’Ã†â€™ÃƒÂ¢Ã¢â€šÂ¬Ã…Â¡ÃƒÆ’Ã¢â‚¬Å¡Ãƒâ€šÃ‚Â¡ÃƒÆ’Ã†â€™Ãƒâ€ Ã¢â‚¬â„¢ÃƒÆ’Ã¢â‚¬Â ÃƒÂ¢Ã¢â€šÂ¬Ã¢â€žÂ¢ÃƒÆ’Ã†â€™Ãƒâ€šÃ‚Â¢ÃƒÆ’Ã‚Â¢ÃƒÂ¢Ã¢â€šÂ¬Ã…Â¡Ãƒâ€šÃ‚Â¬ÃƒÆ’Ã¢â‚¬Â¦Ãƒâ€šÃ‚Â¡ÃƒÆ’Ã†â€™Ãƒâ€ Ã¢â‚¬â„¢ÃƒÆ’Ã‚Â¢ÃƒÂ¢Ã¢â‚¬Å¡Ã‚Â¬Ãƒâ€¦Ã‚Â¡ÃƒÆ’Ã†â€™ÃƒÂ¢Ã¢â€šÂ¬Ã…Â¡ÃƒÆ’Ã¢â‚¬Å¡Ãƒâ€šÃ‚Â¬ÃƒÆ’Ã†â€™Ãƒâ€ Ã¢â‚¬â„¢ÃƒÆ’Ã¢â‚¬Â ÃƒÂ¢Ã¢â€šÂ¬Ã¢â€žÂ¢ÃƒÆ’Ã†â€™ÃƒÂ¢Ã¢â€šÂ¬Ã‚Â ÃƒÆ’Ã‚Â¢ÃƒÂ¢Ã¢â‚¬Å¡Ã‚Â¬ÃƒÂ¢Ã¢â‚¬Å¾Ã‚Â¢ÃƒÆ’Ã†â€™Ãƒâ€ Ã¢â‚¬â„¢ÃƒÆ’Ã¢â‚¬Å¡Ãƒâ€šÃ‚Â¢ÃƒÆ’Ã†â€™Ãƒâ€šÃ‚Â¢ÃƒÆ’Ã‚Â¢ÃƒÂ¢Ã¢â‚¬Å¡Ã‚Â¬Ãƒâ€¦Ã‚Â¡ÃƒÆ’Ã¢â‚¬Å¡Ãƒâ€šÃ‚Â¬ÃƒÆ’Ã†â€™ÃƒÂ¢Ã¢â€šÂ¬Ã…Â¡ÃƒÆ’Ã¢â‚¬Å¡Ãƒâ€šÃ‚Â¦ÃƒÆ’Ã†â€™Ãƒâ€ Ã¢â‚¬â„¢ÃƒÆ’Ã¢â‚¬Â ÃƒÂ¢Ã¢â€šÂ¬Ã¢â€žÂ¢ÃƒÆ’Ã†â€™ÃƒÂ¢Ã¢â€šÂ¬Ã…Â¡ÃƒÆ’Ã¢â‚¬Å¡Ãƒâ€šÃ‚Â¢ÃƒÆ’Ã†â€™Ãƒâ€ Ã¢â‚¬â„¢ÃƒÆ’Ã¢â‚¬Å¡Ãƒâ€šÃ‚Â¢ÃƒÆ’Ã†â€™Ãƒâ€šÃ‚Â¢ÃƒÆ’Ã‚Â¢ÃƒÂ¢Ã¢â€šÂ¬Ã…Â¡Ãƒâ€šÃ‚Â¬ÃƒÆ’Ã¢â‚¬Â¦Ãƒâ€šÃ‚Â¡ÃƒÆ’Ã†â€™ÃƒÂ¢Ã¢â€šÂ¬Ã…Â¡ÃƒÆ’Ã¢â‚¬Å¡Ãƒâ€šÃ‚Â¬ÃƒÆ’Ã†â€™Ãƒâ€ Ã¢â‚¬â„¢ÃƒÆ’Ã‚Â¢ÃƒÂ¢Ã¢â‚¬Å¡Ã‚Â¬Ãƒâ€šÃ‚Â¦ÃƒÆ’Ã†â€™Ãƒâ€šÃ‚Â¢ÃƒÆ’Ã‚Â¢ÃƒÂ¢Ã¢â€šÂ¬Ã…Â¡Ãƒâ€šÃ‚Â¬ÃƒÆ’Ã¢â‚¬Â¦ÃƒÂ¢Ã¢â€šÂ¬Ã…â€œWk3), both treatments recorded negative growth rates, with the IMTA system showing a sharper decline (-5.953 g/day) compared to the Monoculture (-2.916 g/day). During the recovery phase (Wk3ÃƒÆ’Ã†â€™Ãƒâ€ Ã¢â‚¬â„¢ÃƒÆ’Ã¢â‚¬Â ÃƒÂ¢Ã¢â€šÂ¬Ã¢â€žÂ¢ÃƒÆ’Ã†â€™ÃƒÂ¢Ã¢â€šÂ¬Ã‚Â ÃƒÆ’Ã‚Â¢ÃƒÂ¢Ã¢â‚¬Å¡Ã‚Â¬ÃƒÂ¢Ã¢â‚¬Å¾Ã‚Â¢ÃƒÆ’Ã†â€™Ãƒâ€ Ã¢â‚¬â„¢ÃƒÆ’Ã‚Â¢ÃƒÂ¢Ã¢â‚¬Å¡Ã‚Â¬Ãƒâ€šÃ‚Â ÃƒÆ’Ã†â€™Ãƒâ€šÃ‚Â¢ÃƒÆ’Ã‚Â¢ÃƒÂ¢Ã¢â€šÂ¬Ã…Â¡Ãƒâ€šÃ‚Â¬ÃƒÆ’Ã‚Â¢ÃƒÂ¢Ã¢â€šÂ¬Ã…Â¾Ãƒâ€šÃ‚Â¢ÃƒÆ’Ã†â€™Ãƒâ€ Ã¢â‚¬â„¢ÃƒÆ’Ã¢â‚¬Â ÃƒÂ¢Ã¢â€šÂ¬Ã¢â€žÂ¢ÃƒÆ’Ã†â€™Ãƒâ€šÃ‚Â¢ÃƒÆ’Ã‚Â¢ÃƒÂ¢Ã¢â€šÂ¬Ã…Â¡Ãƒâ€šÃ‚Â¬ÃƒÆ’Ã¢â‚¬Å¡Ãƒâ€šÃ‚Â ÃƒÆ’Ã†â€™Ãƒâ€ Ã¢â‚¬â„¢ÃƒÆ’Ã¢â‚¬Å¡Ãƒâ€šÃ‚Â¢ÃƒÆ’Ã†â€™Ãƒâ€šÃ‚Â¢ÃƒÆ’Ã‚Â¢ÃƒÂ¢Ã¢â‚¬Å¡Ã‚Â¬Ãƒâ€¦Ã‚Â¡ÃƒÆ’Ã¢â‚¬Å¡Ãƒâ€šÃ‚Â¬ÃƒÆ’Ã†â€™Ãƒâ€šÃ‚Â¢ÃƒÆ’Ã‚Â¢ÃƒÂ¢Ã¢â‚¬Å¡Ã‚Â¬Ãƒâ€¦Ã‚Â¾ÃƒÆ’Ã¢â‚¬Å¡Ãƒâ€šÃ‚Â¢ÃƒÆ’Ã†â€™Ãƒâ€ Ã¢â‚¬â„¢ÃƒÆ’Ã¢â‚¬Â ÃƒÂ¢Ã¢â€šÂ¬Ã¢â€žÂ¢ÃƒÆ’Ã†â€™ÃƒÂ¢Ã¢â€šÂ¬Ã‚Â ÃƒÆ’Ã‚Â¢ÃƒÂ¢Ã¢â‚¬Å¡Ã‚Â¬ÃƒÂ¢Ã¢â‚¬Å¾Ã‚Â¢ÃƒÆ’Ã†â€™Ãƒâ€ Ã¢â‚¬â„¢ÃƒÆ’Ã¢â‚¬Å¡Ãƒâ€šÃ‚Â¢ÃƒÆ’Ã†â€™Ãƒâ€šÃ‚Â¢ÃƒÆ’Ã‚Â¢ÃƒÂ¢Ã¢â‚¬Å¡Ã‚Â¬Ãƒâ€¦Ã‚Â¡ÃƒÆ’Ã¢â‚¬Å¡Ãƒâ€šÃ‚Â¬ÃƒÆ’Ã†â€™ÃƒÂ¢Ã¢â€šÂ¬Ã‚Â¦ÃƒÆ’Ã¢â‚¬Å¡Ãƒâ€šÃ‚Â¡ÃƒÆ’Ã†â€™Ãƒâ€ Ã¢â‚¬â„¢ÃƒÆ’Ã¢â‚¬Â ÃƒÂ¢Ã¢â€šÂ¬Ã¢â€žÂ¢ÃƒÆ’Ã†â€™Ãƒâ€šÃ‚Â¢ÃƒÆ’Ã‚Â¢ÃƒÂ¢Ã¢â€šÂ¬Ã…Â¡Ãƒâ€šÃ‚Â¬ÃƒÆ’Ã¢â‚¬Â¦Ãƒâ€šÃ‚Â¡ÃƒÆ’Ã†â€™Ãƒâ€ Ã¢â‚¬â„¢ÃƒÆ’Ã‚Â¢ÃƒÂ¢Ã¢â‚¬Å¡Ã‚Â¬Ãƒâ€¦Ã‚Â¡ÃƒÆ’Ã†â€™ÃƒÂ¢Ã¢â€šÂ¬Ã…Â¡ÃƒÆ’Ã¢â‚¬Å¡Ãƒâ€šÃ‚Â¢ÃƒÆ’Ã†â€™Ãƒâ€ Ã¢â‚¬â„¢ÃƒÆ’Ã¢â‚¬Â ÃƒÂ¢Ã¢â€šÂ¬Ã¢â€žÂ¢ÃƒÆ’Ã†â€™ÃƒÂ¢Ã¢â€šÂ¬Ã‚Â ÃƒÆ’Ã‚Â¢ÃƒÂ¢Ã¢â‚¬Å¡Ã‚Â¬ÃƒÂ¢Ã¢â‚¬Å¾Ã‚Â¢ÃƒÆ’Ã†â€™Ãƒâ€ Ã¢â‚¬â„¢ÃƒÆ’Ã‚Â¢ÃƒÂ¢Ã¢â‚¬Å¡Ã‚Â¬Ãƒâ€šÃ‚Â ÃƒÆ’Ã†â€™Ãƒâ€šÃ‚Â¢ÃƒÆ’Ã‚Â¢ÃƒÂ¢Ã¢â€šÂ¬Ã…Â¡Ãƒâ€šÃ‚Â¬ÃƒÆ’Ã‚Â¢ÃƒÂ¢Ã¢â€šÂ¬Ã…Â¾Ãƒâ€šÃ‚Â¢ÃƒÆ’Ã†â€™Ãƒâ€ Ã¢â‚¬â„¢ÃƒÆ’Ã¢â‚¬Â ÃƒÂ¢Ã¢â€šÂ¬Ã¢â€žÂ¢ÃƒÆ’Ã†â€™Ãƒâ€šÃ‚Â¢ÃƒÆ’Ã‚Â¢ÃƒÂ¢Ã¢â€šÂ¬Ã…Â¡Ãƒâ€šÃ‚Â¬ÃƒÆ’Ã¢â‚¬Â¦Ãƒâ€šÃ‚Â¡ÃƒÆ’Ã†â€™Ãƒâ€ Ã¢â‚¬â„¢ÃƒÆ’Ã‚Â¢ÃƒÂ¢Ã¢â‚¬Å¡Ã‚Â¬Ãƒâ€¦Ã‚Â¡ÃƒÆ’Ã†â€™ÃƒÂ¢Ã¢â€šÂ¬Ã…Â¡ÃƒÆ’Ã¢â‚¬Å¡Ãƒâ€šÃ‚Â¢ÃƒÆ’Ã†â€™Ãƒâ€ Ã¢â‚¬â„¢ÃƒÆ’Ã¢â‚¬Â ÃƒÂ¢Ã¢â€šÂ¬Ã¢â€žÂ¢ÃƒÆ’Ã†â€™ÃƒÂ¢Ã¢â€šÂ¬Ã‚Â ÃƒÆ’Ã‚Â¢ÃƒÂ¢Ã¢â‚¬Å¡Ã‚Â¬ÃƒÂ¢Ã¢â‚¬Å¾Ã‚Â¢ÃƒÆ’Ã†â€™Ãƒâ€ Ã¢â‚¬â„¢ÃƒÆ’Ã‚Â¢ÃƒÂ¢Ã¢â‚¬Å¡Ã‚Â¬Ãƒâ€¦Ã‚Â¡ÃƒÆ’Ã†â€™ÃƒÂ¢Ã¢â€šÂ¬Ã…Â¡ÃƒÆ’Ã¢â‚¬Å¡Ãƒâ€šÃ‚Â¢ÃƒÆ’Ã†â€™Ãƒâ€ Ã¢â‚¬â„¢ÃƒÆ’Ã¢â‚¬Â ÃƒÂ¢Ã¢â€šÂ¬Ã¢â€žÂ¢ÃƒÆ’Ã†â€™ÃƒÂ¢Ã¢â€šÂ¬Ã…Â¡ÃƒÆ’Ã¢â‚¬Å¡Ãƒâ€šÃ‚Â¢ÃƒÆ’Ã†â€™Ãƒâ€ Ã¢â‚¬â„¢ÃƒÆ’Ã¢â‚¬Å¡Ãƒâ€šÃ‚Â¢ÃƒÆ’Ã†â€™Ãƒâ€šÃ‚Â¢ÃƒÆ’Ã‚Â¢ÃƒÂ¢Ã¢â‚¬Å¡Ã‚Â¬Ãƒâ€¦Ã‚Â¡ÃƒÆ’Ã¢â‚¬Å¡Ãƒâ€šÃ‚Â¬ÃƒÆ’Ã†â€™ÃƒÂ¢Ã¢â€šÂ¬Ã‚Â¦ÃƒÆ’Ã¢â‚¬Å¡Ãƒâ€šÃ‚Â¡ÃƒÆ’Ã†â€™Ãƒâ€ Ã¢â‚¬â„¢ÃƒÆ’Ã‚Â¢ÃƒÂ¢Ã¢â‚¬Å¡Ã‚Â¬Ãƒâ€¦Ã‚Â¡ÃƒÆ’Ã†â€™ÃƒÂ¢Ã¢â€šÂ¬Ã…Â¡ÃƒÆ’Ã¢â‚¬Å¡Ãƒâ€šÃ‚Â¬ÃƒÆ’Ã†â€™Ãƒâ€ Ã¢â‚¬â„¢ÃƒÆ’Ã¢â‚¬Â ÃƒÂ¢Ã¢â€šÂ¬Ã¢â€žÂ¢ÃƒÆ’Ã†â€™Ãƒâ€šÃ‚Â¢ÃƒÆ’Ã‚Â¢ÃƒÂ¢Ã¢â€šÂ¬Ã…Â¡Ãƒâ€šÃ‚Â¬ÃƒÆ’Ã¢â‚¬Å¡Ãƒâ€šÃ‚Â¦ÃƒÆ’Ã†â€™Ãƒâ€ Ã¢â‚¬â„¢ÃƒÆ’Ã‚Â¢ÃƒÂ¢Ã¢â‚¬Å¡Ã‚Â¬Ãƒâ€¦Ã‚Â¡ÃƒÆ’Ã†â€™ÃƒÂ¢Ã¢â€šÂ¬Ã…Â¡ÃƒÆ’Ã¢â‚¬Å¡Ãƒâ€šÃ‚Â¡ÃƒÆ’Ã†â€™Ãƒâ€ Ã¢â‚¬â„¢ÃƒÆ’Ã¢â‚¬Â ÃƒÂ¢Ã¢â€šÂ¬Ã¢â€žÂ¢ÃƒÆ’Ã†â€™ÃƒÂ¢Ã¢â€šÂ¬Ã‚Â ÃƒÆ’Ã‚Â¢ÃƒÂ¢Ã¢â‚¬Å¡Ã‚Â¬ÃƒÂ¢Ã¢â‚¬Å¾Ã‚Â¢ÃƒÆ’Ã†â€™Ãƒâ€ Ã¢â‚¬â„¢ÃƒÆ’Ã¢â‚¬Å¡Ãƒâ€šÃ‚Â¢ÃƒÆ’Ã†â€™Ãƒâ€šÃ‚Â¢ÃƒÆ’Ã‚Â¢ÃƒÂ¢Ã¢â‚¬Å¡Ã‚Â¬Ãƒâ€¦Ã‚Â¡ÃƒÆ’Ã¢â‚¬Å¡Ãƒâ€šÃ‚Â¬ÃƒÆ’Ã†â€™ÃƒÂ¢Ã¢â€šÂ¬Ã‚Â¦ÃƒÆ’Ã¢â‚¬Å¡Ãƒâ€šÃ‚Â¡ÃƒÆ’Ã†â€™Ãƒâ€ Ã¢â‚¬â„¢ÃƒÆ’Ã¢â‚¬Â ÃƒÂ¢Ã¢â€šÂ¬Ã¢â€žÂ¢ÃƒÆ’Ã†â€™Ãƒâ€šÃ‚Â¢ÃƒÆ’Ã‚Â¢ÃƒÂ¢Ã¢â€šÂ¬Ã…Â¡Ãƒâ€šÃ‚Â¬ÃƒÆ’Ã¢â‚¬Â¦Ãƒâ€šÃ‚Â¡ÃƒÆ’Ã†â€™Ãƒâ€ Ã¢â‚¬â„¢ÃƒÆ’Ã‚Â¢ÃƒÂ¢Ã¢â‚¬Å¡Ã‚Â¬Ãƒâ€¦Ã‚Â¡ÃƒÆ’Ã†â€™ÃƒÂ¢Ã¢â€šÂ¬Ã…Â¡ÃƒÆ’Ã¢â‚¬Å¡Ãƒâ€šÃ‚Â¬ÃƒÆ’Ã†â€™Ãƒâ€ Ã¢â‚¬â„¢ÃƒÆ’Ã¢â‚¬Â ÃƒÂ¢Ã¢â€šÂ¬Ã¢â€žÂ¢ÃƒÆ’Ã†â€™ÃƒÂ¢Ã¢â€šÂ¬Ã‚Â ÃƒÆ’Ã‚Â¢ÃƒÂ¢Ã¢â‚¬Å¡Ã‚Â¬ÃƒÂ¢Ã¢â‚¬Å¾Ã‚Â¢ÃƒÆ’Ã†â€™Ãƒâ€ Ã¢â‚¬â„¢ÃƒÆ’Ã‚Â¢ÃƒÂ¢Ã¢â‚¬Å¡Ã‚Â¬Ãƒâ€šÃ‚Â ÃƒÆ’Ã†â€™Ãƒâ€šÃ‚Â¢ÃƒÆ’Ã‚Â¢ÃƒÂ¢Ã¢â€šÂ¬Ã…Â¡Ãƒâ€šÃ‚Â¬ÃƒÆ’Ã‚Â¢ÃƒÂ¢Ã¢â€šÂ¬Ã…Â¾Ãƒâ€šÃ‚Â¢ÃƒÆ’Ã†â€™Ãƒâ€ Ã¢â‚¬â„¢ÃƒÆ’Ã¢â‚¬Â ÃƒÂ¢Ã¢â€šÂ¬Ã¢â€žÂ¢ÃƒÆ’Ã†â€™Ãƒâ€šÃ‚Â¢ÃƒÆ’Ã‚Â¢ÃƒÂ¢Ã¢â€šÂ¬Ã…Â¡Ãƒâ€šÃ‚Â¬ÃƒÆ’Ã¢â‚¬Â¦Ãƒâ€šÃ‚Â¡ÃƒÆ’Ã†â€™Ãƒâ€ Ã¢â‚¬â„¢ÃƒÆ’Ã‚Â¢ÃƒÂ¢Ã¢â‚¬Å¡Ã‚Â¬Ãƒâ€¦Ã‚Â¡ÃƒÆ’Ã†â€™ÃƒÂ¢Ã¢â€šÂ¬Ã…Â¡ÃƒÆ’Ã¢â‚¬Å¡Ãƒâ€šÃ‚Â¢ÃƒÆ’Ã†â€™Ãƒâ€ Ã¢â‚¬â„¢ÃƒÆ’Ã¢â‚¬Â ÃƒÂ¢Ã¢â€šÂ¬Ã¢â€žÂ¢ÃƒÆ’Ã†â€™ÃƒÂ¢Ã¢â€šÂ¬Ã‚Â ÃƒÆ’Ã‚Â¢ÃƒÂ¢Ã¢â‚¬Å¡Ã‚Â¬ÃƒÂ¢Ã¢â‚¬Å¾Ã‚Â¢ÃƒÆ’Ã†â€™Ãƒâ€ Ã¢â‚¬â„¢ÃƒÆ’Ã‚Â¢ÃƒÂ¢Ã¢â‚¬Å¡Ã‚Â¬Ãƒâ€¦Ã‚Â¡ÃƒÆ’Ã†â€™ÃƒÂ¢Ã¢â€šÂ¬Ã…Â¡ÃƒÆ’Ã¢â‚¬Å¡Ãƒâ€šÃ‚Â¢ÃƒÆ’Ã†â€™Ãƒâ€ Ã¢â‚¬â„¢ÃƒÆ’Ã¢â‚¬Â ÃƒÂ¢Ã¢â€šÂ¬Ã¢â€žÂ¢ÃƒÆ’Ã†â€™ÃƒÂ¢Ã¢â€šÂ¬Ã…Â¡ÃƒÆ’Ã¢â‚¬Å¡Ãƒâ€šÃ‚Â¢ÃƒÆ’Ã†â€™Ãƒâ€ Ã¢â‚¬â„¢ÃƒÆ’Ã¢â‚¬Å¡Ãƒâ€šÃ‚Â¢ÃƒÆ’Ã†â€™Ãƒâ€šÃ‚Â¢ÃƒÆ’Ã‚Â¢ÃƒÂ¢Ã¢â€šÂ¬Ã…Â¡Ãƒâ€šÃ‚Â¬ÃƒÆ’Ã¢â‚¬Â¦Ãƒâ€šÃ‚Â¡ÃƒÆ’Ã†â€™ÃƒÂ¢Ã¢â€šÂ¬Ã…Â¡ÃƒÆ’Ã¢â‚¬Å¡Ãƒâ€šÃ‚Â¬ÃƒÆ’Ã†â€™Ãƒâ€ Ã¢â‚¬â„¢ÃƒÆ’Ã‚Â¢ÃƒÂ¢Ã¢â‚¬Å¡Ã‚Â¬Ãƒâ€šÃ‚Â¦ÃƒÆ’Ã†â€™ÃƒÂ¢Ã¢â€šÂ¬Ã…Â¡ÃƒÆ’Ã¢â‚¬Å¡Ãƒâ€šÃ‚Â¡ÃƒÆ’Ã†â€™Ãƒâ€ Ã¢â‚¬â„¢ÃƒÆ’Ã¢â‚¬Â ÃƒÂ¢Ã¢â€šÂ¬Ã¢â€žÂ¢ÃƒÆ’Ã†â€™Ãƒâ€šÃ‚Â¢ÃƒÆ’Ã‚Â¢ÃƒÂ¢Ã¢â€šÂ¬Ã…Â¡Ãƒâ€šÃ‚Â¬ÃƒÆ’Ã¢â‚¬Â¦Ãƒâ€šÃ‚Â¡ÃƒÆ’Ã†â€™Ãƒâ€ Ã¢â‚¬â„¢ÃƒÆ’Ã‚Â¢ÃƒÂ¢Ã¢â‚¬Å¡Ã‚Â¬Ãƒâ€¦Ã‚Â¡ÃƒÆ’Ã†â€™ÃƒÂ¢Ã¢â€šÂ¬Ã…Â¡ÃƒÆ’Ã¢â‚¬Å¡Ãƒâ€šÃ‚Â¬ÃƒÆ’Ã†â€™Ãƒâ€ Ã¢â‚¬â„¢ÃƒÆ’Ã¢â‚¬Â ÃƒÂ¢Ã¢â€šÂ¬Ã¢â€žÂ¢ÃƒÆ’Ã†â€™ÃƒÂ¢Ã¢â€šÂ¬Ã‚Â ÃƒÆ’Ã‚Â¢ÃƒÂ¢Ã¢â‚¬Å¡Ã‚Â¬ÃƒÂ¢Ã¢â‚¬Å¾Ã‚Â¢ÃƒÆ’Ã†â€™Ãƒâ€ Ã¢â‚¬â„¢ÃƒÆ’Ã¢â‚¬Å¡Ãƒâ€šÃ‚Â¢ÃƒÆ’Ã†â€™Ãƒâ€šÃ‚Â¢ÃƒÆ’Ã‚Â¢ÃƒÂ¢Ã¢â‚¬Å¡Ã‚Â¬Ãƒâ€¦Ã‚Â¡ÃƒÆ’Ã¢â‚¬Å¡Ãƒâ€šÃ‚Â¬ÃƒÆ’Ã†â€™ÃƒÂ¢Ã¢â€šÂ¬Ã…Â¡ÃƒÆ’Ã¢â‚¬Å¡Ãƒâ€šÃ‚Â¦ÃƒÆ’Ã†â€™Ãƒâ€ Ã¢â‚¬â„¢ÃƒÆ’Ã¢â‚¬Â ÃƒÂ¢Ã¢â€šÂ¬Ã¢â€žÂ¢ÃƒÆ’Ã†â€™ÃƒÂ¢Ã¢â€šÂ¬Ã…Â¡ÃƒÆ’Ã¢â‚¬Å¡Ãƒâ€šÃ‚Â¢ÃƒÆ’Ã†â€™Ãƒâ€ Ã¢â‚¬â„¢ÃƒÆ’Ã¢â‚¬Å¡Ãƒâ€šÃ‚Â¢ÃƒÆ’Ã†â€™Ãƒâ€šÃ‚Â¢ÃƒÆ’Ã‚Â¢ÃƒÂ¢Ã¢â€šÂ¬Ã…Â¡Ãƒâ€šÃ‚Â¬ÃƒÆ’Ã¢â‚¬Â¦Ãƒâ€šÃ‚Â¡ÃƒÆ’Ã†â€™ÃƒÂ¢Ã¢â€šÂ¬Ã…Â¡ÃƒÆ’Ã¢â‚¬Å¡Ãƒâ€šÃ‚Â¬ÃƒÆ’Ã†â€™Ãƒâ€ Ã¢â‚¬â„¢ÃƒÆ’Ã‚Â¢ÃƒÂ¢Ã¢â‚¬Å¡Ã‚Â¬Ãƒâ€šÃ‚Â¦ÃƒÆ’Ã†â€™Ãƒâ€šÃ‚Â¢ÃƒÆ’Ã‚Â¢ÃƒÂ¢Ã¢â€šÂ¬Ã…Â¡Ãƒâ€šÃ‚Â¬ÃƒÆ’Ã¢â‚¬Â¦ÃƒÂ¢Ã¢â€šÂ¬Ã…â€œWk4), both systems experienced strong positive growth, with Monoculture slightly higher (10.370 g/day) than IMTA (9.087 g/day).</w:t>
-      </w:r>
-    </w:p>
-    <w:p>
-      <w:pPr>
-        <w:spacing w:line="360" w:lineRule="auto"/>
-        <w:rPr>
-          <w:rFonts w:ascii="Times New Roman" w:hAnsi="Times New Roman" w:cs="Times New Roman"/>
-        </w:rPr>
-      </w:pPr>
-      <w:r>
-        <w:rPr>
-          <w:rFonts w:ascii="Times New Roman" w:hAnsi="Times New Roman" w:cs="Times New Roman"/>
-        </w:rPr>
-        <w:t xml:space="preserve">A major divergence occurred in the Wk4ÃƒÆ’Ã†â€™Ãƒâ€ Ã¢â‚¬â„¢ÃƒÆ’Ã¢â‚¬Â ÃƒÂ¢Ã¢â€šÂ¬Ã¢â€žÂ¢ÃƒÆ’Ã†â€™ÃƒÂ¢Ã¢â€šÂ¬Ã‚Â ÃƒÆ’Ã‚Â¢ÃƒÂ¢Ã¢â‚¬Å¡Ã‚Â¬ÃƒÂ¢Ã¢â‚¬Å¾Ã‚Â¢ÃƒÆ’Ã†â€™Ãƒâ€ Ã¢â‚¬â„¢ÃƒÆ’Ã‚Â¢ÃƒÂ¢Ã¢â‚¬Å¡Ã‚Â¬Ãƒâ€šÃ‚Â ÃƒÆ’Ã†â€™Ãƒâ€šÃ‚Â¢ÃƒÆ’Ã‚Â¢ÃƒÂ¢Ã¢â€šÂ¬Ã…Â¡Ãƒâ€šÃ‚Â¬ÃƒÆ’Ã‚Â¢ÃƒÂ¢Ã¢â€šÂ¬Ã…Â¾Ãƒâ€šÃ‚Â¢ÃƒÆ’Ã†â€™Ãƒâ€ Ã¢â‚¬â„¢ÃƒÆ’Ã¢â‚¬Â ÃƒÂ¢Ã¢â€šÂ¬Ã¢â€žÂ¢ÃƒÆ’Ã†â€™Ãƒâ€šÃ‚Â¢ÃƒÆ’Ã‚Â¢ÃƒÂ¢Ã¢â€šÂ¬Ã…Â¡Ãƒâ€šÃ‚Â¬ÃƒÆ’Ã¢â‚¬Å¡Ãƒâ€šÃ‚Â ÃƒÆ’Ã†â€™Ãƒâ€ Ã¢â‚¬â„¢ÃƒÆ’Ã¢â‚¬Å¡Ãƒâ€šÃ‚Â¢ÃƒÆ’Ã†â€™Ãƒâ€šÃ‚Â¢ÃƒÆ’Ã‚Â¢ÃƒÂ¢Ã¢â‚¬Å¡Ã‚Â¬Ãƒâ€¦Ã‚Â¡ÃƒÆ’Ã¢â‚¬Å¡Ãƒâ€šÃ‚Â¬ÃƒÆ’Ã†â€™Ãƒâ€šÃ‚Â¢ÃƒÆ’Ã‚Â¢ÃƒÂ¢Ã¢â‚¬Å¡Ã‚Â¬Ãƒâ€¦Ã‚Â¾ÃƒÆ’Ã¢â‚¬Å¡Ãƒâ€šÃ‚Â¢ÃƒÆ’Ã†â€™Ãƒâ€ Ã¢â‚¬â„¢ÃƒÆ’Ã¢â‚¬Â ÃƒÂ¢Ã¢â€šÂ¬Ã¢â€žÂ¢ÃƒÆ’Ã†â€™ÃƒÂ¢Ã¢â€šÂ¬Ã‚Â ÃƒÆ’Ã‚Â¢ÃƒÂ¢Ã¢â‚¬Å¡Ã‚Â¬ÃƒÂ¢Ã¢â‚¬Å¾Ã‚Â¢ÃƒÆ’Ã†â€™Ãƒâ€ Ã¢â‚¬â„¢ÃƒÆ’Ã¢â‚¬Å¡Ãƒâ€šÃ‚Â¢ÃƒÆ’Ã†â€™Ãƒâ€šÃ‚Â¢ÃƒÆ’Ã‚Â¢ÃƒÂ¢Ã¢â‚¬Å¡Ã‚Â¬Ãƒâ€¦Ã‚Â¡ÃƒÆ’Ã¢â‚¬Å¡Ãƒâ€šÃ‚Â¬ÃƒÆ’Ã†â€™ÃƒÂ¢Ã¢â€šÂ¬Ã‚Â¦ÃƒÆ’Ã¢â‚¬Å¡Ãƒâ€šÃ‚Â¡ÃƒÆ’Ã†â€™Ãƒâ€ Ã¢â‚¬â„¢ÃƒÆ’Ã¢â‚¬Â ÃƒÂ¢Ã¢â€šÂ¬Ã¢â€žÂ¢ÃƒÆ’Ã†â€™Ãƒâ€šÃ‚Â¢ÃƒÆ’Ã‚Â¢ÃƒÂ¢Ã¢â€šÂ¬Ã…Â¡Ãƒâ€šÃ‚Â¬ÃƒÆ’Ã¢â‚¬Â¦Ãƒâ€šÃ‚Â¡ÃƒÆ’Ã†â€™Ãƒâ€ Ã¢â‚¬â„¢ÃƒÆ’Ã‚Â¢ÃƒÂ¢Ã¢â‚¬Å¡Ã‚Â¬Ãƒâ€¦Ã‚Â¡ÃƒÆ’Ã†â€™ÃƒÂ¢Ã¢â€šÂ¬Ã…Â¡ÃƒÆ’Ã¢â‚¬Å¡Ãƒâ€šÃ‚Â¢ÃƒÆ’Ã†â€™Ãƒâ€ Ã¢â‚¬â„¢ÃƒÆ’Ã¢â‚¬Â ÃƒÂ¢Ã¢â€šÂ¬Ã¢â€žÂ¢ÃƒÆ’Ã†â€™ÃƒÂ¢Ã¢â€šÂ¬Ã‚Â ÃƒÆ’Ã‚Â¢ÃƒÂ¢Ã¢â‚¬Å¡Ã‚Â¬ÃƒÂ¢Ã¢â‚¬Å¾Ã‚Â¢ÃƒÆ’Ã†â€™Ãƒâ€ Ã¢â‚¬â„¢ÃƒÆ’Ã‚Â¢ÃƒÂ¢Ã¢â‚¬Å¡Ã‚Â¬Ãƒâ€šÃ‚Â ÃƒÆ’Ã†â€™Ãƒâ€šÃ‚Â¢ÃƒÆ’Ã‚Â¢ÃƒÂ¢Ã¢â€šÂ¬Ã…Â¡Ãƒâ€šÃ‚Â¬ÃƒÆ’Ã‚Â¢ÃƒÂ¢Ã¢â€šÂ¬Ã…Â¾Ãƒâ€šÃ‚Â¢ÃƒÆ’Ã†â€™Ãƒâ€ Ã¢â‚¬â„¢ÃƒÆ’Ã¢â‚¬Â ÃƒÂ¢Ã¢â€šÂ¬Ã¢â€žÂ¢ÃƒÆ’Ã†â€™Ãƒâ€šÃ‚Â¢ÃƒÆ’Ã‚Â¢ÃƒÂ¢Ã¢â€šÂ¬Ã…Â¡Ãƒâ€šÃ‚Â¬ÃƒÆ’Ã¢â‚¬Â¦Ãƒâ€šÃ‚Â¡ÃƒÆ’Ã†â€™Ãƒâ€ Ã¢â‚¬â„¢ÃƒÆ’Ã‚Â¢ÃƒÂ¢Ã¢â‚¬Å¡Ã‚Â¬Ãƒâ€¦Ã‚Â¡ÃƒÆ’Ã†â€™ÃƒÂ¢Ã¢â€šÂ¬Ã…Â¡ÃƒÆ’Ã¢â‚¬Å¡Ãƒâ€šÃ‚Â¢ÃƒÆ’Ã†â€™Ãƒâ€ Ã¢â‚¬â„¢ÃƒÆ’Ã¢â‚¬Â ÃƒÂ¢Ã¢â€šÂ¬Ã¢â€žÂ¢ÃƒÆ’Ã†â€™ÃƒÂ¢Ã¢â€šÂ¬Ã‚Â ÃƒÆ’Ã‚Â¢ÃƒÂ¢Ã¢â‚¬Å¡Ã‚Â¬ÃƒÂ¢Ã¢â‚¬Å¾Ã‚Â¢ÃƒÆ’Ã†â€™Ãƒâ€ Ã¢â‚¬â„¢ÃƒÆ’Ã‚Â¢ÃƒÂ¢Ã¢â‚¬Å¡Ã‚Â¬Ãƒâ€¦Ã‚Â¡ÃƒÆ’Ã†â€™ÃƒÂ¢Ã¢â€šÂ¬Ã…Â¡ÃƒÆ’Ã¢â‚¬Å¡Ãƒâ€šÃ‚Â¢ÃƒÆ’Ã†â€™Ãƒâ€ Ã¢â‚¬â„¢ÃƒÆ’Ã¢â‚¬Â ÃƒÂ¢Ã¢â€šÂ¬Ã¢â€žÂ¢ÃƒÆ’Ã†â€™ÃƒÂ¢Ã¢â€šÂ¬Ã…Â¡ÃƒÆ’Ã¢â‚¬Å¡Ãƒâ€šÃ‚Â¢ÃƒÆ’Ã†â€™Ãƒâ€ Ã¢â‚¬â„¢ÃƒÆ’Ã¢â‚¬Å¡Ãƒâ€šÃ‚Â¢ÃƒÆ’Ã†â€™Ãƒâ€šÃ‚Â¢ÃƒÆ’Ã‚Â¢ÃƒÂ¢Ã¢â‚¬Å¡Ã‚Â¬Ãƒâ€¦Ã‚Â¡ÃƒÆ’Ã¢â‚¬Å¡Ãƒâ€šÃ‚Â¬ÃƒÆ’Ã†â€™ÃƒÂ¢Ã¢â€šÂ¬Ã‚Â¦ÃƒÆ’Ã¢â‚¬Å¡Ãƒâ€šÃ‚Â¡ÃƒÆ’Ã†â€™Ãƒâ€ Ã¢â‚¬â„¢ÃƒÆ’Ã‚Â¢ÃƒÂ¢Ã¢â‚¬Å¡Ã‚Â¬Ãƒâ€¦Ã‚Â¡ÃƒÆ’Ã†â€™ÃƒÂ¢Ã¢â€šÂ¬Ã…Â¡ÃƒÆ’Ã¢â‚¬Å¡Ãƒâ€šÃ‚Â¬ÃƒÆ’Ã†â€™Ãƒâ€ Ã¢â‚¬â„¢ÃƒÆ’Ã¢â‚¬Â ÃƒÂ¢Ã¢â€šÂ¬Ã¢â€žÂ¢ÃƒÆ’Ã†â€™Ãƒâ€šÃ‚Â¢ÃƒÆ’Ã‚Â¢ÃƒÂ¢Ã¢â€šÂ¬Ã…Â¡Ãƒâ€šÃ‚Â¬ÃƒÆ’Ã¢â‚¬Å¡Ãƒâ€šÃ‚Â¦ÃƒÆ’Ã†â€™Ãƒâ€ Ã¢â‚¬â„¢ÃƒÆ’Ã‚Â¢ÃƒÂ¢Ã¢â‚¬Å¡Ã‚Â¬Ãƒâ€¦Ã‚Â¡ÃƒÆ’Ã†â€™ÃƒÂ¢Ã¢â€šÂ¬Ã…Â¡ÃƒÆ’Ã¢â‚¬Å¡Ãƒâ€šÃ‚Â¡ÃƒÆ’Ã†â€™Ãƒâ€ Ã¢â‚¬â„¢ÃƒÆ’Ã¢â‚¬Â ÃƒÂ¢Ã¢â€šÂ¬Ã¢â€žÂ¢ÃƒÆ’Ã†â€™ÃƒÂ¢Ã¢â€šÂ¬Ã‚Â ÃƒÆ’Ã‚Â¢ÃƒÂ¢Ã¢â‚¬Å¡Ã‚Â¬ÃƒÂ¢Ã¢â‚¬Å¾Ã‚Â¢ÃƒÆ’Ã†â€™Ãƒâ€ Ã¢â‚¬â„¢ÃƒÆ’Ã¢â‚¬Å¡Ãƒâ€šÃ‚Â¢ÃƒÆ’Ã†â€™Ãƒâ€šÃ‚Â¢ÃƒÆ’Ã‚Â¢ÃƒÂ¢Ã¢â‚¬Å¡Ã‚Â¬Ãƒâ€¦Ã‚Â¡ÃƒÆ’Ã¢â‚¬Å¡Ãƒâ€šÃ‚Â¬ÃƒÆ’Ã†â€™ÃƒÂ¢Ã¢â€šÂ¬Ã‚Â¦ÃƒÆ’Ã¢â‚¬Å¡Ãƒâ€šÃ‚Â¡ÃƒÆ’Ã†â€™Ãƒâ€ Ã¢â‚¬â„¢ÃƒÆ’Ã¢â‚¬Â ÃƒÂ¢Ã¢â€šÂ¬Ã¢â€žÂ¢ÃƒÆ’Ã†â€™Ãƒâ€šÃ‚Â¢ÃƒÆ’Ã‚Â¢ÃƒÂ¢Ã¢â€šÂ¬Ã…Â¡Ãƒâ€šÃ‚Â¬ÃƒÆ’Ã¢â‚¬Â¦Ãƒâ€šÃ‚Â¡ÃƒÆ’Ã†â€™Ãƒâ€ Ã¢â‚¬â„¢ÃƒÆ’Ã‚Â¢ÃƒÂ¢Ã¢â‚¬Å¡Ã‚Â¬Ãƒâ€¦Ã‚Â¡ÃƒÆ’Ã†â€™ÃƒÂ¢Ã¢â€šÂ¬Ã…Â¡ÃƒÆ’Ã¢â‚¬Å¡Ãƒâ€šÃ‚Â¬ÃƒÆ’Ã†â€™Ãƒâ€ Ã¢â‚¬â„¢ÃƒÆ’Ã¢â‚¬Â ÃƒÂ¢Ã¢â€šÂ¬Ã¢â€žÂ¢ÃƒÆ’Ã†â€™ÃƒÂ¢Ã¢â€šÂ¬Ã‚Â ÃƒÆ’Ã‚Â¢ÃƒÂ¢Ã¢â‚¬Å¡Ã‚Â¬ÃƒÂ¢Ã¢â‚¬Å¾Ã‚Â¢ÃƒÆ’Ã†â€™Ãƒâ€ Ã¢â‚¬â„¢ÃƒÆ’Ã‚Â¢ÃƒÂ¢Ã¢â‚¬Å¡Ã‚Â¬Ãƒâ€šÃ‚Â ÃƒÆ’Ã†â€™Ãƒâ€šÃ‚Â¢ÃƒÆ’Ã‚Â¢ÃƒÂ¢Ã¢â€šÂ¬Ã…Â¡Ãƒâ€šÃ‚Â¬ÃƒÆ’Ã‚Â¢ÃƒÂ¢Ã¢â€šÂ¬Ã…Â¾Ãƒâ€šÃ‚Â¢ÃƒÆ’Ã†â€™Ãƒâ€ Ã¢â‚¬â„¢ÃƒÆ’Ã¢â‚¬Â ÃƒÂ¢Ã¢â€šÂ¬Ã¢â€žÂ¢ÃƒÆ’Ã†â€™Ãƒâ€šÃ‚Â¢ÃƒÆ’Ã‚Â¢ÃƒÂ¢Ã¢â€šÂ¬Ã…Â¡Ãƒâ€šÃ‚Â¬ÃƒÆ’Ã¢â‚¬Â¦Ãƒâ€šÃ‚Â¡ÃƒÆ’Ã†â€™Ãƒâ€ Ã¢â‚¬â„¢ÃƒÆ’Ã‚Â¢ÃƒÂ¢Ã¢â‚¬Å¡Ã‚Â¬Ãƒâ€¦Ã‚Â¡ÃƒÆ’Ã†â€™ÃƒÂ¢Ã¢â€šÂ¬Ã…Â¡ÃƒÆ’Ã¢â‚¬Å¡Ãƒâ€šÃ‚Â¢ÃƒÆ’Ã†â€™Ãƒâ€ Ã¢â‚¬â„¢ÃƒÆ’Ã¢â‚¬Â ÃƒÂ¢Ã¢â€šÂ¬Ã¢â€žÂ¢ÃƒÆ’Ã†â€™ÃƒÂ¢Ã¢â€šÂ¬Ã‚Â ÃƒÆ’Ã‚Â¢ÃƒÂ¢Ã¢â‚¬Å¡Ã‚Â¬ÃƒÂ¢Ã¢â‚¬Å¾Ã‚Â¢ÃƒÆ’Ã†â€™Ãƒâ€ Ã¢â‚¬â„¢ÃƒÆ’Ã‚Â¢ÃƒÂ¢Ã¢â‚¬Å¡Ã‚Â¬Ãƒâ€¦Ã‚Â¡ÃƒÆ’Ã†â€™ÃƒÂ¢Ã¢â€šÂ¬Ã…Â¡ÃƒÆ’Ã¢â‚¬Å¡Ãƒâ€šÃ‚Â¢ÃƒÆ’Ã†â€™Ãƒâ€ Ã¢â‚¬â„¢ÃƒÆ’Ã¢â‚¬Â ÃƒÂ¢Ã¢â€šÂ¬Ã¢â€žÂ¢ÃƒÆ’Ã†â€™ÃƒÂ¢Ã¢â€šÂ¬Ã…Â¡ÃƒÆ’Ã¢â‚¬Å¡Ãƒâ€šÃ‚Â¢ÃƒÆ’Ã†â€™Ãƒâ€ Ã¢â‚¬â„¢ÃƒÆ’Ã¢â‚¬Å¡Ãƒâ€šÃ‚Â¢ÃƒÆ’Ã†â€™Ãƒâ€šÃ‚Â¢ÃƒÆ’Ã‚Â¢ÃƒÂ¢Ã¢â€šÂ¬Ã…Â¡Ãƒâ€šÃ‚Â¬ÃƒÆ’Ã¢â‚¬Â¦Ãƒâ€šÃ‚Â¡ÃƒÆ’Ã†â€™ÃƒÂ¢Ã¢â€šÂ¬Ã…Â¡ÃƒÆ’Ã¢â‚¬Å¡Ãƒâ€šÃ‚Â¬ÃƒÆ’Ã†â€™Ãƒâ€ Ã¢â‚¬â„¢ÃƒÆ’Ã‚Â¢ÃƒÂ¢Ã¢â‚¬Å¡Ã‚Â¬Ãƒâ€šÃ‚Â¦ÃƒÆ’Ã†â€™ÃƒÂ¢Ã¢â€šÂ¬Ã…Â¡ÃƒÆ’Ã¢â‚¬Å¡Ãƒâ€šÃ‚Â¡ÃƒÆ’Ã†â€™Ãƒâ€ Ã¢â‚¬â„¢ÃƒÆ’Ã¢â‚¬Â ÃƒÂ¢Ã¢â€šÂ¬Ã¢â€žÂ¢ÃƒÆ’Ã†â€™Ãƒâ€šÃ‚Â¢ÃƒÆ’Ã‚Â¢ÃƒÂ¢Ã¢â€šÂ¬Ã…Â¡Ãƒâ€šÃ‚Â¬ÃƒÆ’Ã¢â‚¬Â¦Ãƒâ€šÃ‚Â¡ÃƒÆ’Ã†â€™Ãƒâ€ Ã¢â‚¬â„¢ÃƒÆ’Ã‚Â¢ÃƒÂ¢Ã¢â‚¬Å¡Ã‚Â¬Ãƒâ€¦Ã‚Â¡ÃƒÆ’Ã†â€™ÃƒÂ¢Ã¢â€šÂ¬Ã…Â¡ÃƒÆ’Ã¢â‚¬Å¡Ãƒâ€šÃ‚Â¬ÃƒÆ’Ã†â€™Ãƒâ€ Ã¢â‚¬â„¢ÃƒÆ’Ã¢â‚¬Â ÃƒÂ¢Ã¢â€šÂ¬Ã¢â€žÂ¢ÃƒÆ’Ã†â€™ÃƒÂ¢Ã¢â€šÂ¬Ã‚Â ÃƒÆ’Ã‚Â¢ÃƒÂ¢Ã¢â‚¬Å¡Ã‚Â¬ÃƒÂ¢Ã¢â‚¬Å¾Ã‚Â¢ÃƒÆ’Ã†â€™Ãƒâ€ Ã¢â‚¬â„¢ÃƒÆ’Ã¢â‚¬Å¡Ãƒâ€šÃ‚Â¢ÃƒÆ’Ã†â€™Ãƒâ€šÃ‚Â¢ÃƒÆ’Ã‚Â¢ÃƒÂ¢Ã¢â‚¬Å¡Ã‚Â¬Ãƒâ€¦Ã‚Â¡ÃƒÆ’Ã¢â‚¬Å¡Ãƒâ€šÃ‚Â¬ÃƒÆ’Ã†â€™ÃƒÂ¢Ã¢â€šÂ¬Ã…Â¡ÃƒÆ’Ã¢â‚¬Å¡Ãƒâ€šÃ‚Â¦ÃƒÆ’Ã†â€™Ãƒâ€ Ã¢â‚¬â„¢ÃƒÆ’Ã¢â‚¬Â ÃƒÂ¢Ã¢â€šÂ¬Ã¢â€žÂ¢ÃƒÆ’Ã†â€™ÃƒÂ¢Ã¢â€šÂ¬Ã…Â¡ÃƒÆ’Ã¢â‚¬Å¡Ãƒâ€šÃ‚Â¢ÃƒÆ’Ã†â€™Ãƒâ€ Ã¢â‚¬â„¢ÃƒÆ’Ã¢â‚¬Å¡Ãƒâ€šÃ‚Â¢ÃƒÆ’Ã†â€™Ãƒâ€šÃ‚Â¢ÃƒÆ’Ã‚Â¢ÃƒÂ¢Ã¢â€šÂ¬Ã…Â¡Ãƒâ€šÃ‚Â¬ÃƒÆ’Ã¢â‚¬Â¦Ãƒâ€šÃ‚Â¡ÃƒÆ’Ã†â€™ÃƒÂ¢Ã¢â€šÂ¬Ã…Â¡ÃƒÆ’Ã¢â‚¬Å¡Ãƒâ€šÃ‚Â¬ÃƒÆ’Ã†â€™Ãƒâ€ Ã¢â‚¬â„¢ÃƒÆ’Ã‚Â¢ÃƒÂ¢Ã¢â‚¬Å¡Ã‚Â¬Ãƒâ€šÃ‚Â¦ÃƒÆ’Ã†â€™Ãƒâ€šÃ‚Â¢ÃƒÆ’Ã‚Â¢ÃƒÂ¢Ã¢â€šÂ¬Ã…Â¡Ãƒâ€šÃ‚Â¬ÃƒÆ’Ã¢â‚¬Â¦ÃƒÂ¢Ã¢â€šÂ¬Ã…â€œWk5 interval, where the Monoculture system showed a severe drop in growth (-27.608 g/day), while the IMTA system only recorded a minor decline (-2.266 g/day), indicating greater stability in the IMTA setup. In the final interval (Wk5ÃƒÆ’Ã†â€™Ãƒâ€ Ã¢â‚¬â„¢ÃƒÆ’Ã¢â‚¬Â ÃƒÂ¢Ã¢â€šÂ¬Ã¢â€žÂ¢ÃƒÆ’Ã†â€™ÃƒÂ¢Ã¢â€šÂ¬Ã‚Â ÃƒÆ’Ã‚Â¢ÃƒÂ¢Ã¢â‚¬Å¡Ã‚Â¬ÃƒÂ¢Ã¢â‚¬Å¾Ã‚Â¢ÃƒÆ’Ã†â€™Ãƒâ€ Ã¢â‚¬â„¢ÃƒÆ’Ã‚Â¢ÃƒÂ¢Ã¢â‚¬Å¡Ã‚Â¬Ãƒâ€šÃ‚Â ÃƒÆ’Ã†â€™Ãƒâ€šÃ‚Â¢ÃƒÆ’Ã‚Â¢ÃƒÂ¢Ã¢â€šÂ¬Ã…Â¡Ãƒâ€šÃ‚Â¬ÃƒÆ’Ã‚Â¢ÃƒÂ¢Ã¢â€šÂ¬Ã…Â¾Ãƒâ€šÃ‚Â¢ÃƒÆ’Ã†â€™Ãƒâ€ Ã¢â‚¬â„¢ÃƒÆ’Ã¢â‚¬Â ÃƒÂ¢Ã¢â€šÂ¬Ã¢â€žÂ¢ÃƒÆ’Ã†â€™Ãƒâ€šÃ‚Â¢ÃƒÆ’Ã‚Â¢ÃƒÂ¢Ã¢â€šÂ¬Ã…Â¡Ãƒâ€šÃ‚Â¬ÃƒÆ’Ã¢â‚¬Å¡Ãƒâ€šÃ‚Â ÃƒÆ’Ã†â€™Ãƒâ€ Ã¢â‚¬â„¢ÃƒÆ’Ã¢â‚¬Å¡Ãƒâ€šÃ‚Â¢ÃƒÆ’Ã†â€™Ãƒâ€šÃ‚Â¢ÃƒÆ’Ã‚Â¢ÃƒÂ¢Ã¢â‚¬Å¡Ã‚Â¬Ãƒâ€¦Ã‚Â¡ÃƒÆ’Ã¢â‚¬Å¡Ãƒâ€šÃ‚Â¬ÃƒÆ’Ã†â€™Ãƒâ€šÃ‚Â¢ÃƒÆ’Ã‚Â¢ÃƒÂ¢Ã¢â‚¬Å¡Ã‚Â¬Ãƒâ€¦Ã‚Â¾ÃƒÆ’Ã¢â‚¬Å¡Ãƒâ€šÃ‚Â¢ÃƒÆ’Ã†â€™Ãƒâ€ Ã¢â‚¬â„¢ÃƒÆ’Ã¢â‚¬Â ÃƒÂ¢Ã¢â€šÂ¬Ã¢â€žÂ¢ÃƒÆ’Ã†â€™ÃƒÂ¢Ã¢â€šÂ¬Ã‚Â ÃƒÆ’Ã‚Â¢ÃƒÂ¢Ã¢â‚¬Å¡Ã‚Â¬ÃƒÂ¢Ã¢â‚¬Å¾Ã‚Â¢ÃƒÆ’Ã†â€™Ãƒâ€ Ã¢â‚¬â„¢ÃƒÆ’Ã¢â‚¬Å¡Ãƒâ€šÃ‚Â¢ÃƒÆ’Ã†â€™Ãƒâ€šÃ‚Â¢ÃƒÆ’Ã‚Â¢ÃƒÂ¢Ã¢â‚¬Å¡Ã‚Â¬Ãƒâ€¦Ã‚Â¡ÃƒÆ’Ã¢â‚¬Å¡Ãƒâ€šÃ‚Â¬ÃƒÆ’Ã†â€™ÃƒÂ¢Ã¢â€šÂ¬Ã‚Â¦ÃƒÆ’Ã¢â‚¬Å¡Ãƒâ€šÃ‚Â¡ÃƒÆ’Ã†â€™Ãƒâ€ Ã¢â‚¬â„¢ÃƒÆ’Ã¢â‚¬Â ÃƒÂ¢Ã¢â€šÂ¬Ã¢â€žÂ¢ÃƒÆ’Ã†â€™Ãƒâ€šÃ‚Â¢ÃƒÆ’Ã‚Â¢ÃƒÂ¢Ã¢â€šÂ¬Ã…Â¡Ãƒâ€šÃ‚Â¬ÃƒÆ’Ã¢â‚¬Â¦Ãƒâ€šÃ‚Â¡ÃƒÆ’Ã†â€™Ãƒâ€ Ã¢â‚¬â„¢ÃƒÆ’Ã‚Â¢ÃƒÂ¢Ã¢â‚¬Å¡Ã‚Â¬Ãƒâ€¦Ã‚Â¡ÃƒÆ’Ã†â€™ÃƒÂ¢Ã¢â€šÂ¬Ã…Â¡ÃƒÆ’Ã¢â‚¬Å¡Ãƒâ€šÃ‚Â¢ÃƒÆ’Ã†â€™Ãƒâ€ Ã¢â‚¬â„¢ÃƒÆ’Ã¢â‚¬Â ÃƒÂ¢Ã¢â€šÂ¬Ã¢â€žÂ¢ÃƒÆ’Ã†â€™ÃƒÂ¢Ã¢â€šÂ¬Ã‚Â ÃƒÆ’Ã‚Â¢ÃƒÂ¢Ã¢â‚¬Å¡Ã‚Â¬ÃƒÂ¢Ã¢â‚¬Å¾Ã‚Â¢ÃƒÆ’Ã†â€™Ãƒâ€ Ã¢â‚¬â„¢ÃƒÆ’Ã‚Â¢ÃƒÂ¢Ã¢â‚¬Å¡Ã‚Â¬Ãƒâ€šÃ‚Â ÃƒÆ’Ã†â€™Ãƒâ€šÃ‚Â¢ÃƒÆ’Ã‚Â¢ÃƒÂ¢Ã¢â€šÂ¬Ã…Â¡Ãƒâ€šÃ‚Â¬ÃƒÆ’Ã‚Â¢ÃƒÂ¢Ã¢â€šÂ¬Ã…Â¾Ãƒâ€šÃ‚Â¢ÃƒÆ’Ã†â€™Ãƒâ€ Ã¢â‚¬â„¢ÃƒÆ’Ã¢â‚¬Â ÃƒÂ¢Ã¢â€šÂ¬Ã¢â€žÂ¢ÃƒÆ’Ã†â€™Ãƒâ€šÃ‚Â¢ÃƒÆ’Ã‚Â¢ÃƒÂ¢Ã¢â€šÂ¬Ã…Â¡Ãƒâ€šÃ‚Â¬ÃƒÆ’Ã¢â‚¬Â¦Ãƒâ€šÃ‚Â¡ÃƒÆ’Ã†â€™Ãƒâ€ Ã¢â‚¬â„¢ÃƒÆ’Ã‚Â¢ÃƒÂ¢Ã¢â‚¬Å¡Ã‚Â¬Ãƒâ€¦Ã‚Â¡ÃƒÆ’Ã†â€™ÃƒÂ¢Ã¢â€šÂ¬Ã…Â¡ÃƒÆ’Ã¢â‚¬Å¡Ãƒâ€šÃ‚Â¢ÃƒÆ’Ã†â€™Ãƒâ€ Ã¢â‚¬â„¢ÃƒÆ’Ã¢â‚¬Â ÃƒÂ¢Ã¢â€šÂ¬Ã¢â€žÂ¢ÃƒÆ’Ã†â€™ÃƒÂ¢Ã¢â€šÂ¬Ã‚Â ÃƒÆ’Ã‚Â¢ÃƒÂ¢Ã¢â‚¬Å¡Ã‚Â¬ÃƒÂ¢Ã¢â‚¬Å¾Ã‚Â¢ÃƒÆ’Ã†â€™Ãƒâ€ Ã¢â‚¬â„¢ÃƒÆ’Ã‚Â¢ÃƒÂ¢Ã¢â‚¬Å¡Ã‚Â¬Ãƒâ€¦Ã‚Â¡ÃƒÆ’Ã†â€™ÃƒÂ¢Ã¢â€šÂ¬Ã…Â¡ÃƒÆ’Ã¢â‚¬Å¡Ãƒâ€šÃ‚Â¢ÃƒÆ’Ã†â€™Ãƒâ€ Ã¢â‚¬â„¢ÃƒÆ’Ã¢â‚¬Â ÃƒÂ¢Ã¢â€šÂ¬Ã¢â€žÂ¢ÃƒÆ’Ã†â€™ÃƒÂ¢Ã¢â€šÂ¬Ã…Â¡ÃƒÆ’Ã¢â‚¬Å¡Ãƒâ€šÃ‚Â¢ÃƒÆ’Ã†â€™Ãƒâ€ Ã¢â‚¬â„¢ÃƒÆ’Ã¢â‚¬Å¡Ãƒâ€šÃ‚Â¢ÃƒÆ’Ã†â€™Ãƒâ€šÃ‚Â¢ÃƒÆ’Ã‚Â¢ÃƒÂ¢Ã¢â‚¬Å¡Ã‚Â¬Ãƒâ€¦Ã‚Â¡ÃƒÆ’Ã¢â‚¬Å¡Ãƒâ€šÃ‚Â¬ÃƒÆ’Ã†â€™ÃƒÂ¢Ã¢â€šÂ¬Ã‚Â¦ÃƒÆ’Ã¢â‚¬Å¡Ãƒâ€šÃ‚Â¡ÃƒÆ’Ã†â€™Ãƒâ€ Ã¢â‚¬â„¢ÃƒÆ’Ã‚Â¢ÃƒÂ¢Ã¢â‚¬Å¡Ã‚Â¬Ãƒâ€¦Ã‚Â¡ÃƒÆ’Ã†â€™ÃƒÂ¢Ã¢â€šÂ¬Ã…Â¡ÃƒÆ’Ã¢â‚¬Å¡Ãƒâ€šÃ‚Â¬ÃƒÆ’Ã†â€™Ãƒâ€ Ã¢â‚¬â„¢ÃƒÆ’Ã¢â‚¬Â ÃƒÂ¢Ã¢â€šÂ¬Ã¢â€žÂ¢ÃƒÆ’Ã†â€™Ãƒâ€šÃ‚Â¢ÃƒÆ’Ã‚Â¢ÃƒÂ¢Ã¢â€šÂ¬Ã…Â¡Ãƒâ€šÃ‚Â¬ÃƒÆ’Ã¢â‚¬Å¡Ãƒâ€šÃ‚Â¦ÃƒÆ’Ã†â€™Ãƒâ€ Ã¢â‚¬â„¢ÃƒÆ’Ã‚Â¢ÃƒÂ¢Ã¢â‚¬Å¡Ã‚Â¬Ãƒâ€¦Ã‚Â¡ÃƒÆ’Ã†â€™ÃƒÂ¢Ã¢â€šÂ¬Ã…Â¡ÃƒÆ’Ã¢â‚¬Å¡Ãƒâ€šÃ‚Â¡ÃƒÆ’Ã†â€™Ãƒâ€ Ã¢â‚¬â„¢ÃƒÆ’Ã¢â‚¬Â ÃƒÂ¢Ã¢â€šÂ¬Ã¢â€žÂ¢ÃƒÆ’Ã†â€™ÃƒÂ¢Ã¢â€šÂ¬Ã‚Â ÃƒÆ’Ã‚Â¢ÃƒÂ¢Ã¢â‚¬Å¡Ã‚Â¬ÃƒÂ¢Ã¢â‚¬Å¾Ã‚Â¢ÃƒÆ’Ã†â€™Ãƒâ€ Ã¢â‚¬â„¢ÃƒÆ’Ã¢â‚¬Å¡Ãƒâ€šÃ‚Â¢ÃƒÆ’Ã†â€™Ãƒâ€šÃ‚Â¢ÃƒÆ’Ã‚Â¢ÃƒÂ¢Ã¢â‚¬Å¡Ã‚Â¬Ãƒâ€¦Ã‚Â¡ÃƒÆ’Ã¢â‚¬Å¡Ãƒâ€šÃ‚Â¬ÃƒÆ’Ã†â€™ÃƒÂ¢Ã¢â€šÂ¬Ã‚Â¦ÃƒÆ’Ã¢â‚¬Å¡Ãƒâ€šÃ‚Â¡ÃƒÆ’Ã†â€™Ãƒâ€ Ã¢â‚¬â„¢ÃƒÆ’Ã¢â‚¬Â ÃƒÂ¢Ã¢â€šÂ¬Ã¢â€žÂ¢ÃƒÆ’Ã†â€™Ãƒâ€šÃ‚Â¢ÃƒÆ’Ã‚Â¢ÃƒÂ¢Ã¢â€šÂ¬Ã…Â¡Ãƒâ€šÃ‚Â¬ÃƒÆ’Ã¢â‚¬Â¦Ãƒâ€šÃ‚Â¡ÃƒÆ’Ã†â€™Ãƒâ€ Ã¢â‚¬â„¢ÃƒÆ’Ã‚Â¢ÃƒÂ¢Ã¢â‚¬Å¡Ã‚Â¬Ãƒâ€¦Ã‚Â¡ÃƒÆ’Ã†â€™ÃƒÂ¢Ã¢â€šÂ¬Ã…Â¡ÃƒÆ’Ã¢â‚¬Å¡Ãƒâ€šÃ‚Â¬ÃƒÆ’Ã†â€™Ãƒâ€ Ã¢â‚¬â„¢ÃƒÆ’Ã¢â‚¬Â ÃƒÂ¢Ã¢â€šÂ¬Ã¢â€žÂ¢ÃƒÆ’Ã†â€™ÃƒÂ¢Ã¢â€šÂ¬Ã‚Â ÃƒÆ’Ã‚Â¢ÃƒÂ¢Ã¢â‚¬Å¡Ã‚Â¬ÃƒÂ¢Ã¢â‚¬Å¾Ã‚Â¢ÃƒÆ’Ã†â€™Ãƒâ€ Ã¢â‚¬â„¢ÃƒÆ’Ã‚Â¢ÃƒÂ¢Ã¢â‚¬Å¡Ã‚Â¬Ãƒâ€šÃ‚Â ÃƒÆ’Ã†â€™Ãƒâ€šÃ‚Â¢ÃƒÆ’Ã‚Â¢ÃƒÂ¢Ã¢â€šÂ¬Ã…Â¡Ãƒâ€šÃ‚Â¬ÃƒÆ’Ã‚Â¢ÃƒÂ¢Ã¢â€šÂ¬Ã…Â¾Ãƒâ€šÃ‚Â¢ÃƒÆ’Ã†â€™Ãƒâ€ Ã¢â‚¬â„¢ÃƒÆ’Ã¢â‚¬Â ÃƒÂ¢Ã¢â€šÂ¬Ã¢â€žÂ¢ÃƒÆ’Ã†â€™Ãƒâ€šÃ‚Â¢ÃƒÆ’Ã‚Â¢ÃƒÂ¢Ã¢â€šÂ¬Ã…Â¡Ãƒâ€šÃ‚Â¬ÃƒÆ’Ã¢â‚¬Â¦Ãƒâ€šÃ‚Â¡ÃƒÆ’Ã†â€™Ãƒâ€ Ã¢â‚¬â„¢ÃƒÆ’Ã‚Â¢ÃƒÂ¢Ã¢â‚¬Å¡Ã‚Â¬Ãƒâ€¦Ã‚Â¡ÃƒÆ’Ã†â€™ÃƒÂ¢Ã¢â€šÂ¬Ã…Â¡ÃƒÆ’Ã¢â‚¬Å¡Ãƒâ€šÃ‚Â¢ÃƒÆ’Ã†â€™Ãƒâ€ Ã¢â‚¬â„¢ÃƒÆ’Ã¢â‚¬Â ÃƒÂ¢Ã¢â€šÂ¬Ã¢â€žÂ¢ÃƒÆ’Ã†â€™ÃƒÂ¢Ã¢â€šÂ¬Ã‚Â ÃƒÆ’Ã‚Â¢ÃƒÂ¢Ã¢â‚¬Å¡Ã‚Â¬ÃƒÂ¢Ã¢â‚¬Å¾Ã‚Â¢ÃƒÆ’Ã†â€™Ãƒâ€ Ã¢â‚¬â„¢ÃƒÆ’Ã‚Â¢ÃƒÂ¢Ã¢â‚¬Å¡Ã‚Â¬Ãƒâ€¦Ã‚Â¡ÃƒÆ’Ã†â€™ÃƒÂ¢Ã¢â€šÂ¬Ã…Â¡ÃƒÆ’Ã¢â‚¬Å¡Ãƒâ€šÃ‚Â¢ÃƒÆ’Ã†â€™Ãƒâ€ Ã¢â‚¬â„¢ÃƒÆ’Ã¢â‚¬Â ÃƒÂ¢Ã¢â€šÂ¬Ã¢â€žÂ¢ÃƒÆ’Ã†â€™ÃƒÂ¢Ã¢â€šÂ¬Ã…Â¡ÃƒÆ’Ã¢â‚¬Å¡Ãƒâ€šÃ‚Â¢ÃƒÆ’Ã†â€™Ãƒâ€ Ã¢â‚¬â„¢ÃƒÆ’Ã¢â‚¬Å¡Ãƒâ€šÃ‚Â¢ÃƒÆ’Ã†â€™Ãƒâ€šÃ‚Â¢ÃƒÆ’Ã‚Â¢ÃƒÂ¢Ã¢â€šÂ¬Ã…Â¡Ãƒâ€šÃ‚Â¬ÃƒÆ’Ã¢â‚¬Â¦Ãƒâ€šÃ‚Â¡ÃƒÆ’Ã†â€™ÃƒÂ¢Ã¢â€šÂ¬Ã…Â¡ÃƒÆ’Ã¢â‚¬Å¡Ãƒâ€šÃ‚Â¬ÃƒÆ’Ã†â€™Ãƒâ€ Ã¢â‚¬â„¢ÃƒÆ’Ã‚Â¢ÃƒÂ¢Ã¢â‚¬Å¡Ã‚Â¬Ãƒâ€šÃ‚Â¦ÃƒÆ’Ã†â€™ÃƒÂ¢Ã¢â€šÂ¬Ã…Â¡ÃƒÆ’Ã¢â‚¬Å¡Ãƒâ€šÃ‚Â¡ÃƒÆ’Ã†â€™Ãƒâ€ Ã¢â‚¬â„¢ÃƒÆ’Ã¢â‚¬Â ÃƒÂ¢Ã¢â€šÂ¬Ã¢â€žÂ¢ÃƒÆ’Ã†â€™Ãƒâ€šÃ‚Â¢ÃƒÆ’Ã‚Â¢ÃƒÂ¢Ã¢â€šÂ¬Ã…Â¡Ãƒâ€šÃ‚Â¬ÃƒÆ’Ã¢â‚¬Â¦Ãƒâ€šÃ‚Â¡ÃƒÆ’Ã†â€™Ãƒâ€ Ã¢â‚¬â„¢ÃƒÆ’Ã‚Â¢ÃƒÂ¢Ã¢â‚¬Å¡Ã‚Â¬Ãƒâ€¦Ã‚Â¡ÃƒÆ’Ã†â€™ÃƒÂ¢Ã¢â€šÂ¬Ã…Â¡ÃƒÆ’Ã¢â‚¬Å¡Ãƒâ€šÃ‚Â¬ÃƒÆ’Ã†â€™Ãƒâ€ Ã¢â‚¬â„¢ÃƒÆ’Ã¢â‚¬Â ÃƒÂ¢Ã¢â€šÂ¬Ã¢â€žÂ¢ÃƒÆ’Ã†â€™ÃƒÂ¢Ã¢â€šÂ¬Ã‚Â ÃƒÆ’Ã‚Â¢ÃƒÂ¢Ã¢â‚¬Å¡Ã‚Â¬ÃƒÂ¢Ã¢â‚¬Å¾Ã‚Â¢ÃƒÆ’Ã†â€™Ãƒâ€ Ã¢â‚¬â„¢ÃƒÆ’Ã¢â‚¬Å¡Ãƒâ€šÃ‚Â¢ÃƒÆ’Ã†â€™Ãƒâ€šÃ‚Â¢ÃƒÆ’Ã‚Â¢ÃƒÂ¢Ã¢â‚¬Å¡Ã‚Â¬Ãƒâ€¦Ã‚Â¡ÃƒÆ’Ã¢â‚¬Å¡Ãƒâ€šÃ‚Â¬ÃƒÆ’Ã†â€™ÃƒÂ¢Ã¢â€šÂ¬Ã…Â¡ÃƒÆ’Ã¢â‚¬Å¡Ãƒâ€šÃ‚Â¦ÃƒÆ’Ã†â€™Ãƒâ€ Ã¢â‚¬â„¢ÃƒÆ’Ã¢â‚¬Â ÃƒÂ¢Ã¢â€šÂ¬Ã¢â€žÂ¢ÃƒÆ’Ã†â€™ÃƒÂ¢Ã¢â€šÂ¬Ã…Â¡ÃƒÆ’Ã¢â‚¬Å¡Ãƒâ€šÃ‚Â¢ÃƒÆ’Ã†â€™Ãƒâ€ Ã¢â‚¬â„¢ÃƒÆ’Ã¢â‚¬Å¡Ãƒâ€šÃ‚Â¢ÃƒÆ’Ã†â€™Ãƒâ€šÃ‚Â¢ÃƒÆ’Ã‚Â¢ÃƒÂ¢Ã¢â€šÂ¬Ã…Â¡Ãƒâ€šÃ‚Â¬ÃƒÆ’Ã¢â‚¬Â¦Ãƒâ€šÃ‚Â¡ÃƒÆ’Ã†â€™ÃƒÂ¢Ã¢â€šÂ¬Ã…Â¡ÃƒÆ’Ã¢â‚¬Å¡Ãƒâ€šÃ‚Â¬ÃƒÆ’Ã†â€™Ãƒâ€ Ã¢â‚¬â„¢ÃƒÆ’Ã‚Â¢ÃƒÂ¢Ã¢â‚¬Å¡Ã‚Â¬Ãƒâ€šÃ‚Â¦ÃƒÆ’Ã†â€™Ãƒâ€šÃ‚Â¢ÃƒÆ’Ã‚Â¢ÃƒÂ¢Ã¢â€šÂ¬Ã…Â¡Ãƒâ€šÃ‚Â¬ÃƒÆ’Ã¢â‚¬Â¦ÃƒÂ¢Ã¢â€šÂ¬Ã…â€œWk6), both systems recovered again, with Monoculture reaching the highest AGR (13.854 g/day) and IMTA recording 8.307 g/day. Overall, although the Monoculture system achieved higher peak growth rates, the IMTA system demonstrated more stable and consistent growth performance, </w:t>
+        <w:t xml:space="preserve"> in IMTA and Monoculture systems across four sampling intervals. Overall, both systems show fluctuating growth patterns, including periods of weight loss and recovery. In the early phase (Wk2ÃƒÆ’Ã†â€™Ãƒâ€ Ã¢â‚¬â„¢ÃƒÆ’Ã¢â‚¬Â ÃƒÂ¢Ã¢â€šÂ¬Ã¢â€žÂ¢ÃƒÆ’Ã†â€™ÃƒÂ¢Ã¢â€šÂ¬Ã‚Â ÃƒÆ’Ã‚Â¢ÃƒÂ¢Ã¢â‚¬Å¡Ã‚Â¬ÃƒÂ¢Ã¢â‚¬Å¾Ã‚Â¢ÃƒÆ’Ã†â€™Ãƒâ€ Ã¢â‚¬â„¢ÃƒÆ’Ã‚Â¢ÃƒÂ¢Ã¢â‚¬Å¡Ã‚Â¬Ãƒâ€šÃ‚Â ÃƒÆ’Ã†â€™Ãƒâ€šÃ‚Â¢ÃƒÆ’Ã‚Â¢ÃƒÂ¢Ã¢â€šÂ¬Ã…Â¡Ãƒâ€šÃ‚Â¬ÃƒÆ’Ã‚Â¢ÃƒÂ¢Ã¢â€šÂ¬Ã…Â¾Ãƒâ€šÃ‚Â¢ÃƒÆ’Ã†â€™Ãƒâ€ Ã¢â‚¬â„¢ÃƒÆ’Ã¢â‚¬Â ÃƒÂ¢Ã¢â€šÂ¬Ã¢â€žÂ¢ÃƒÆ’Ã†â€™Ãƒâ€šÃ‚Â¢ÃƒÆ’Ã‚Â¢ÃƒÂ¢Ã¢â€šÂ¬Ã…Â¡Ãƒâ€šÃ‚Â¬ÃƒÆ’Ã¢â‚¬Å¡Ãƒâ€šÃ‚Â ÃƒÆ’Ã†â€™Ãƒâ€ Ã¢â‚¬â„¢ÃƒÆ’Ã¢â‚¬Å¡Ãƒâ€šÃ‚Â¢ÃƒÆ’Ã†â€™Ãƒâ€šÃ‚Â¢ÃƒÆ’Ã‚Â¢ÃƒÂ¢Ã¢â‚¬Å¡Ã‚Â¬Ãƒâ€¦Ã‚Â¡ÃƒÆ’Ã¢â‚¬Å¡Ãƒâ€šÃ‚Â¬ÃƒÆ’Ã†â€™Ãƒâ€šÃ‚Â¢ÃƒÆ’Ã‚Â¢ÃƒÂ¢Ã¢â‚¬Å¡Ã‚Â¬Ãƒâ€¦Ã‚Â¾ÃƒÆ’Ã¢â‚¬Å¡Ãƒâ€šÃ‚Â¢ÃƒÆ’Ã†â€™Ãƒâ€ Ã¢â‚¬â„¢ÃƒÆ’Ã¢â‚¬Â ÃƒÂ¢Ã¢â€šÂ¬Ã¢â€žÂ¢ÃƒÆ’Ã†â€™ÃƒÂ¢Ã¢â€šÂ¬Ã‚Â ÃƒÆ’Ã‚Â¢ÃƒÂ¢Ã¢â‚¬Å¡Ã‚Â¬ÃƒÂ¢Ã¢â‚¬Å¾Ã‚Â¢ÃƒÆ’Ã†â€™Ãƒâ€ Ã¢â‚¬â„¢ÃƒÆ’Ã¢â‚¬Å¡Ãƒâ€šÃ‚Â¢ÃƒÆ’Ã†â€™Ãƒâ€šÃ‚Â¢ÃƒÆ’Ã‚Â¢ÃƒÂ¢Ã¢â‚¬Å¡Ã‚Â¬Ãƒâ€¦Ã‚Â¡ÃƒÆ’Ã¢â‚¬Å¡Ãƒâ€šÃ‚Â¬ÃƒÆ’Ã†â€™ÃƒÂ¢Ã¢â€šÂ¬Ã…Â¡ÃƒÆ’Ã¢â‚¬Å¡Ãƒâ€šÃ‚Â ÃƒÆ’Ã†â€™Ãƒâ€ Ã¢â‚¬â„¢ÃƒÆ’Ã¢â‚¬Â ÃƒÂ¢Ã¢â€šÂ¬Ã¢â€žÂ¢ÃƒÆ’Ã†â€™ÃƒÂ¢Ã¢â€šÂ¬Ã…Â¡ÃƒÆ’Ã¢â‚¬Å¡Ãƒâ€šÃ‚Â¢ÃƒÆ’Ã†â€™Ãƒâ€ Ã¢â‚¬â„¢ÃƒÆ’Ã¢â‚¬Å¡Ãƒâ€šÃ‚Â¢ÃƒÆ’Ã†â€™Ãƒâ€šÃ‚Â¢ÃƒÆ’Ã‚Â¢ÃƒÂ¢Ã¢â€šÂ¬Ã…Â¡Ãƒâ€šÃ‚Â¬ÃƒÆ’Ã¢â‚¬Â¦Ãƒâ€šÃ‚Â¡ÃƒÆ’Ã†â€™ÃƒÂ¢Ã¢â€šÂ¬Ã…Â¡ÃƒÆ’Ã¢â‚¬Å¡Ãƒâ€šÃ‚Â¬ÃƒÆ’Ã†â€™Ãƒâ€ Ã¢â‚¬â„¢ÃƒÆ’Ã¢â‚¬Å¡Ãƒâ€šÃ‚Â¢ÃƒÆ’Ã†â€™Ãƒâ€šÃ‚Â¢ÃƒÆ’Ã‚Â¢ÃƒÂ¢Ã¢â€šÂ¬Ã…Â¡Ãƒâ€šÃ‚Â¬ÃƒÆ’Ã¢â‚¬Â¦Ãƒâ€šÃ‚Â¾ÃƒÆ’Ã†â€™ÃƒÂ¢Ã¢â€šÂ¬Ã…Â¡ÃƒÆ’Ã¢â‚¬Å¡Ãƒâ€šÃ‚Â¢ÃƒÆ’Ã†â€™Ãƒâ€ Ã¢â‚¬â„¢ÃƒÆ’Ã¢â‚¬Â ÃƒÂ¢Ã¢â€šÂ¬Ã¢â€žÂ¢ÃƒÆ’Ã†â€™ÃƒÂ¢Ã¢â€šÂ¬Ã‚Â ÃƒÆ’Ã‚Â¢ÃƒÂ¢Ã¢â‚¬Å¡Ã‚Â¬ÃƒÂ¢Ã¢â‚¬Å¾Ã‚Â¢ÃƒÆ’Ã†â€™Ãƒâ€ Ã¢â‚¬â„¢ÃƒÆ’Ã‚Â¢ÃƒÂ¢Ã¢â‚¬Å¡Ã‚Â¬Ãƒâ€šÃ‚Â ÃƒÆ’Ã†â€™Ãƒâ€šÃ‚Â¢ÃƒÆ’Ã‚Â¢ÃƒÂ¢Ã¢â€šÂ¬Ã…Â¡Ãƒâ€šÃ‚Â¬ÃƒÆ’Ã‚Â¢ÃƒÂ¢Ã¢â€šÂ¬Ã…Â¾Ãƒâ€šÃ‚Â¢ÃƒÆ’Ã†â€™Ãƒâ€ Ã¢â‚¬â„¢ÃƒÆ’Ã¢â‚¬Â ÃƒÂ¢Ã¢â€šÂ¬Ã¢â€žÂ¢ÃƒÆ’Ã†â€™ÃƒÂ¢Ã¢â€šÂ¬Ã…Â¡ÃƒÆ’Ã¢â‚¬Å¡Ãƒâ€šÃ‚Â¢ÃƒÆ’Ã†â€™Ãƒâ€ Ã¢â‚¬â„¢ÃƒÆ’Ã¢â‚¬Å¡Ãƒâ€šÃ‚Â¢ÃƒÆ’Ã†â€™Ãƒâ€šÃ‚Â¢ÃƒÆ’Ã‚Â¢ÃƒÂ¢Ã¢â€šÂ¬Ã…Â¡Ãƒâ€šÃ‚Â¬ÃƒÆ’Ã¢â‚¬Â¦Ãƒâ€šÃ‚Â¡ÃƒÆ’Ã†â€™ÃƒÂ¢Ã¢â€šÂ¬Ã…Â¡ÃƒÆ’Ã¢â‚¬Å¡Ãƒâ€šÃ‚Â¬ÃƒÆ’Ã†â€™Ãƒâ€ Ã¢â‚¬â„¢ÃƒÆ’Ã‚Â¢ÃƒÂ¢Ã¢â‚¬Å¡Ã‚Â¬Ãƒâ€šÃ‚Â¦ÃƒÆ’Ã†â€™ÃƒÂ¢Ã¢â€šÂ¬Ã…Â¡ÃƒÆ’Ã¢â‚¬Å¡Ãƒâ€šÃ‚Â¡ÃƒÆ’Ã†â€™Ãƒâ€ Ã¢â‚¬â„¢ÃƒÆ’Ã¢â‚¬Â ÃƒÂ¢Ã¢â€šÂ¬Ã¢â€žÂ¢ÃƒÆ’Ã†â€™ÃƒÂ¢Ã¢â€šÂ¬Ã‚Â ÃƒÆ’Ã‚Â¢ÃƒÂ¢Ã¢â‚¬Å¡Ã‚Â¬ÃƒÂ¢Ã¢â‚¬Å¾Ã‚Â¢ÃƒÆ’Ã†â€™Ãƒâ€ Ã¢â‚¬â„¢ÃƒÆ’Ã¢â‚¬Å¡Ãƒâ€šÃ‚Â¢ÃƒÆ’Ã†â€™Ãƒâ€šÃ‚Â¢ÃƒÆ’Ã‚Â¢ÃƒÂ¢Ã¢â‚¬Å¡Ã‚Â¬Ãƒâ€¦Ã‚Â¡ÃƒÆ’Ã¢â‚¬Å¡Ãƒâ€šÃ‚Â¬ÃƒÆ’Ã†â€™ÃƒÂ¢Ã¢â€šÂ¬Ã‚Â¦ÃƒÆ’Ã¢â‚¬Å¡Ãƒâ€šÃ‚Â¡ÃƒÆ’Ã†â€™Ãƒâ€ Ã¢â‚¬â„¢ÃƒÆ’Ã¢â‚¬Â ÃƒÂ¢Ã¢â€šÂ¬Ã¢â€žÂ¢ÃƒÆ’Ã†â€™Ãƒâ€šÃ‚Â¢ÃƒÆ’Ã‚Â¢ÃƒÂ¢Ã¢â€šÂ¬Ã…Â¡Ãƒâ€šÃ‚Â¬ÃƒÆ’Ã¢â‚¬Â¦Ãƒâ€šÃ‚Â¡ÃƒÆ’Ã†â€™Ãƒâ€ Ã¢â‚¬â„¢ÃƒÆ’Ã‚Â¢ÃƒÂ¢Ã¢â‚¬Å¡Ã‚Â¬Ãƒâ€¦Ã‚Â¡ÃƒÆ’Ã†â€™ÃƒÂ¢Ã¢â€šÂ¬Ã…Â¡ÃƒÆ’Ã¢â‚¬Å¡Ãƒâ€šÃ‚Â¢ÃƒÆ’Ã†â€™Ãƒâ€ Ã¢â‚¬â„¢ÃƒÆ’Ã¢â‚¬Â ÃƒÂ¢Ã¢â€šÂ¬Ã¢â€žÂ¢ÃƒÆ’Ã†â€™ÃƒÂ¢Ã¢â€šÂ¬Ã‚Â ÃƒÆ’Ã‚Â¢ÃƒÂ¢Ã¢â‚¬Å¡Ã‚Â¬ÃƒÂ¢Ã¢â‚¬Å¾Ã‚Â¢ÃƒÆ’Ã†â€™Ãƒâ€ Ã¢â‚¬â„¢ÃƒÆ’Ã‚Â¢ÃƒÂ¢Ã¢â‚¬Å¡Ã‚Â¬Ãƒâ€šÃ‚Â ÃƒÆ’Ã†â€™Ãƒâ€šÃ‚Â¢ÃƒÆ’Ã‚Â¢ÃƒÂ¢Ã¢â€šÂ¬Ã…Â¡Ãƒâ€šÃ‚Â¬ÃƒÆ’Ã‚Â¢ÃƒÂ¢Ã¢â€šÂ¬Ã…Â¾Ãƒâ€šÃ‚Â¢ÃƒÆ’Ã†â€™Ãƒâ€ Ã¢â‚¬â„¢ÃƒÆ’Ã¢â‚¬Â ÃƒÂ¢Ã¢â€šÂ¬Ã¢â€žÂ¢ÃƒÆ’Ã†â€™Ãƒâ€šÃ‚Â¢ÃƒÆ’Ã‚Â¢ÃƒÂ¢Ã¢â€šÂ¬Ã…Â¡Ãƒâ€šÃ‚Â¬ÃƒÆ’Ã¢â‚¬Å¡Ãƒâ€šÃ‚Â ÃƒÆ’Ã†â€™Ãƒâ€ Ã¢â‚¬â„¢ÃƒÆ’Ã¢â‚¬Å¡Ãƒâ€šÃ‚Â¢ÃƒÆ’Ã†â€™Ãƒâ€šÃ‚Â¢ÃƒÆ’Ã‚Â¢ÃƒÂ¢Ã¢â‚¬Å¡Ã‚Â¬Ãƒâ€¦Ã‚Â¡ÃƒÆ’Ã¢â‚¬Å¡Ãƒâ€šÃ‚Â¬ÃƒÆ’Ã†â€™Ãƒâ€šÃ‚Â¢ÃƒÆ’Ã‚Â¢ÃƒÂ¢Ã¢â‚¬Å¡Ã‚Â¬Ãƒâ€¦Ã‚Â¾ÃƒÆ’Ã¢â‚¬Å¡Ãƒâ€šÃ‚Â¢ÃƒÆ’Ã†â€™Ãƒâ€ Ã¢â‚¬â„¢ÃƒÆ’Ã¢â‚¬Â ÃƒÂ¢Ã¢â€šÂ¬Ã¢â€žÂ¢ÃƒÆ’Ã†â€™ÃƒÂ¢Ã¢â€šÂ¬Ã‚Â ÃƒÆ’Ã‚Â¢ÃƒÂ¢Ã¢â‚¬Å¡Ã‚Â¬ÃƒÂ¢Ã¢â‚¬Å¾Ã‚Â¢ÃƒÆ’Ã†â€™Ãƒâ€ Ã¢â‚¬â„¢ÃƒÆ’Ã¢â‚¬Å¡Ãƒâ€šÃ‚Â¢ÃƒÆ’Ã†â€™Ãƒâ€šÃ‚Â¢ÃƒÆ’Ã‚Â¢ÃƒÂ¢Ã¢â‚¬Å¡Ã‚Â¬Ãƒâ€¦Ã‚Â¡ÃƒÆ’Ã¢â‚¬Å¡Ãƒâ€šÃ‚Â¬ÃƒÆ’Ã†â€™ÃƒÂ¢Ã¢â€šÂ¬Ã‚Â¦ÃƒÆ’Ã¢â‚¬Å¡Ãƒâ€šÃ‚Â¡ÃƒÆ’Ã†â€™Ãƒâ€ Ã¢â‚¬â„¢ÃƒÆ’Ã¢â‚¬Â ÃƒÂ¢Ã¢â€šÂ¬Ã¢â€žÂ¢ÃƒÆ’Ã†â€™Ãƒâ€šÃ‚Â¢ÃƒÆ’Ã‚Â¢ÃƒÂ¢Ã¢â€šÂ¬Ã…Â¡Ãƒâ€šÃ‚Â¬ÃƒÆ’Ã¢â‚¬Â¦Ãƒâ€šÃ‚Â¡ÃƒÆ’Ã†â€™Ãƒâ€ Ã¢â‚¬â„¢ÃƒÆ’Ã‚Â¢ÃƒÂ¢Ã¢â‚¬Å¡Ã‚Â¬Ãƒâ€¦Ã‚Â¡ÃƒÆ’Ã†â€™ÃƒÂ¢Ã¢â€šÂ¬Ã…Â¡ÃƒÆ’Ã¢â‚¬Å¡Ãƒâ€šÃ‚Â¢ÃƒÆ’Ã†â€™Ãƒâ€ Ã¢â‚¬â„¢ÃƒÆ’Ã¢â‚¬Â ÃƒÂ¢Ã¢â€šÂ¬Ã¢â€žÂ¢ÃƒÆ’Ã†â€™ÃƒÂ¢Ã¢â€šÂ¬Ã‚Â ÃƒÆ’Ã‚Â¢ÃƒÂ¢Ã¢â‚¬Å¡Ã‚Â¬ÃƒÂ¢Ã¢â‚¬Å¾Ã‚Â¢ÃƒÆ’Ã†â€™Ãƒâ€ Ã¢â‚¬â„¢ÃƒÆ’Ã‚Â¢ÃƒÂ¢Ã¢â‚¬Å¡Ã‚Â¬Ãƒâ€šÃ‚Â ÃƒÆ’Ã†â€™Ãƒâ€šÃ‚Â¢ÃƒÆ’Ã‚Â¢ÃƒÂ¢Ã¢â€šÂ¬Ã…Â¡Ãƒâ€šÃ‚Â¬ÃƒÆ’Ã‚Â¢ÃƒÂ¢Ã¢â€šÂ¬Ã…Â¾Ãƒâ€šÃ‚Â¢ÃƒÆ’Ã†â€™Ãƒâ€ Ã¢â‚¬â„¢ÃƒÆ’Ã¢â‚¬Â ÃƒÂ¢Ã¢â€šÂ¬Ã¢â€žÂ¢ÃƒÆ’Ã†â€™Ãƒâ€šÃ‚Â¢ÃƒÆ’Ã‚Â¢ÃƒÂ¢Ã¢â€šÂ¬Ã…Â¡Ãƒâ€šÃ‚Â¬ÃƒÆ’Ã¢â‚¬Â¦Ãƒâ€šÃ‚Â¡ÃƒÆ’Ã†â€™Ãƒâ€ Ã¢â‚¬â„¢ÃƒÆ’Ã‚Â¢ÃƒÂ¢Ã¢â‚¬Å¡Ã‚Â¬Ãƒâ€¦Ã‚Â¡ÃƒÆ’Ã†â€™ÃƒÂ¢Ã¢â€šÂ¬Ã…Â¡ÃƒÆ’Ã¢â‚¬Å¡Ãƒâ€šÃ‚Â¢ÃƒÆ’Ã†â€™Ãƒâ€ Ã¢â‚¬â„¢ÃƒÆ’Ã¢â‚¬Â ÃƒÂ¢Ã¢â€šÂ¬Ã¢â€žÂ¢ÃƒÆ’Ã†â€™ÃƒÂ¢Ã¢â€šÂ¬Ã‚Â ÃƒÆ’Ã‚Â¢ÃƒÂ¢Ã¢â‚¬Å¡Ã‚Â¬ÃƒÂ¢Ã¢â‚¬Å¾Ã‚Â¢ÃƒÆ’Ã†â€™Ãƒâ€ Ã¢â‚¬â„¢ÃƒÆ’Ã‚Â¢ÃƒÂ¢Ã¢â‚¬Å¡Ã‚Â¬Ãƒâ€¦Ã‚Â¡ÃƒÆ’Ã†â€™ÃƒÂ¢Ã¢â€šÂ¬Ã…Â¡ÃƒÆ’Ã¢â‚¬Å¡Ãƒâ€šÃ‚Â¢ÃƒÆ’Ã†â€™Ãƒâ€ Ã¢â‚¬â„¢ÃƒÆ’Ã¢â‚¬Â ÃƒÂ¢Ã¢â€šÂ¬Ã¢â€žÂ¢ÃƒÆ’Ã†â€™ÃƒÂ¢Ã¢â€šÂ¬Ã…Â¡ÃƒÆ’Ã¢â‚¬Å¡Ãƒâ€šÃ‚Â¢ÃƒÆ’Ã†â€™Ãƒâ€ Ã¢â‚¬â„¢ÃƒÆ’Ã¢â‚¬Å¡Ãƒâ€šÃ‚Â¢ÃƒÆ’Ã†â€™Ãƒâ€šÃ‚Â¢ÃƒÆ’Ã‚Â¢ÃƒÂ¢Ã¢â€šÂ¬Ã…Â¡Ãƒâ€šÃ‚Â¬ÃƒÆ’Ã¢â‚¬Â¦Ãƒâ€šÃ‚Â¡ÃƒÆ’Ã†â€™ÃƒÂ¢Ã¢â€šÂ¬Ã…Â¡ÃƒÆ’Ã¢â‚¬Å¡Ãƒâ€šÃ‚Â¬ÃƒÆ’Ã†â€™Ãƒâ€ Ã¢â‚¬â„¢ÃƒÆ’Ã‚Â¢ÃƒÂ¢Ã¢â‚¬Å¡Ã‚Â¬Ãƒâ€šÃ‚Â¦ÃƒÆ’Ã†â€™ÃƒÂ¢Ã¢â€šÂ¬Ã…Â¡ÃƒÆ’Ã¢â‚¬Å¡Ãƒâ€šÃ‚Â¡ÃƒÆ’Ã†â€™Ãƒâ€ Ã¢â‚¬â„¢ÃƒÆ’Ã¢â‚¬Â ÃƒÂ¢Ã¢â€šÂ¬Ã¢â€žÂ¢ÃƒÆ’Ã†â€™Ãƒâ€šÃ‚Â¢ÃƒÆ’Ã‚Â¢ÃƒÂ¢Ã¢â€šÂ¬Ã…Â¡Ãƒâ€šÃ‚Â¬ÃƒÆ’Ã¢â‚¬Â¦Ãƒâ€šÃ‚Â¡ÃƒÆ’Ã†â€™Ãƒâ€ Ã¢â‚¬â„¢ÃƒÆ’Ã‚Â¢ÃƒÂ¢Ã¢â‚¬Å¡Ã‚Â¬Ãƒâ€¦Ã‚Â¡ÃƒÆ’Ã†â€™ÃƒÂ¢Ã¢â€šÂ¬Ã…Â¡ÃƒÆ’Ã¢â‚¬Å¡Ãƒâ€šÃ‚Â¬ÃƒÆ’Ã†â€™Ãƒâ€ Ã¢â‚¬â„¢ÃƒÆ’Ã¢â‚¬Â ÃƒÂ¢Ã¢â€šÂ¬Ã¢â€žÂ¢ÃƒÆ’Ã†â€™ÃƒÂ¢Ã¢â€šÂ¬Ã‚Â ÃƒÆ’Ã‚Â¢ÃƒÂ¢Ã¢â‚¬Å¡Ã‚Â¬ÃƒÂ¢Ã¢â‚¬Å¾Ã‚Â¢ÃƒÆ’Ã†â€™Ãƒâ€ Ã¢â‚¬â„¢ÃƒÆ’Ã¢â‚¬Å¡Ãƒâ€šÃ‚Â¢ÃƒÆ’Ã†â€™Ãƒâ€šÃ‚Â¢ÃƒÆ’Ã‚Â¢ÃƒÂ¢Ã¢â‚¬Å¡Ã‚Â¬Ãƒâ€¦Ã‚Â¡ÃƒÆ’Ã¢â‚¬Å¡Ãƒâ€šÃ‚Â¬ÃƒÆ’Ã†â€™ÃƒÂ¢Ã¢â€šÂ¬Ã…Â¡ÃƒÆ’Ã¢â‚¬Å¡Ãƒâ€šÃ‚Â¦ÃƒÆ’Ã†â€™Ãƒâ€ Ã¢â‚¬â„¢ÃƒÆ’Ã¢â‚¬Â ÃƒÂ¢Ã¢â€šÂ¬Ã¢â€žÂ¢ÃƒÆ’Ã†â€™Ãƒâ€šÃ‚Â¢ÃƒÆ’Ã‚Â¢ÃƒÂ¢Ã¢â€šÂ¬Ã…Â¡Ãƒâ€šÃ‚Â¬ÃƒÆ’Ã¢â‚¬Â¦Ãƒâ€šÃ‚Â¡ÃƒÆ’Ã†â€™Ãƒâ€ Ã¢â‚¬â„¢ÃƒÆ’Ã‚Â¢ÃƒÂ¢Ã¢â‚¬Å¡Ã‚Â¬Ãƒâ€¦Ã‚Â¡ÃƒÆ’Ã†â€™ÃƒÂ¢Ã¢â€šÂ¬Ã…Â¡ÃƒÆ’Ã¢â‚¬Å¡Ãƒâ€šÃ‚Â¡ÃƒÆ’Ã†â€™Ãƒâ€ Ã¢â‚¬â„¢ÃƒÆ’Ã¢â‚¬Â ÃƒÂ¢Ã¢â€šÂ¬Ã¢â€žÂ¢ÃƒÆ’Ã†â€™ÃƒÂ¢Ã¢â€šÂ¬Ã‚Â ÃƒÆ’Ã‚Â¢ÃƒÂ¢Ã¢â‚¬Å¡Ã‚Â¬ÃƒÂ¢Ã¢â‚¬Å¾Ã‚Â¢ÃƒÆ’Ã†â€™Ãƒâ€ Ã¢â‚¬â„¢ÃƒÆ’Ã‚Â¢ÃƒÂ¢Ã¢â‚¬Å¡Ã‚Â¬Ãƒâ€šÃ‚Â ÃƒÆ’Ã†â€™Ãƒâ€šÃ‚Â¢ÃƒÆ’Ã‚Â¢ÃƒÂ¢Ã¢â€šÂ¬Ã…Â¡Ãƒâ€šÃ‚Â¬ÃƒÆ’Ã‚Â¢ÃƒÂ¢Ã¢â€šÂ¬Ã…Â¾Ãƒâ€šÃ‚Â¢ÃƒÆ’Ã†â€™Ãƒâ€ Ã¢â‚¬â„¢ÃƒÆ’Ã¢â‚¬Â ÃƒÂ¢Ã¢â€šÂ¬Ã¢â€žÂ¢ÃƒÆ’Ã†â€™ÃƒÂ¢Ã¢â€šÂ¬Ã…Â¡ÃƒÆ’Ã¢â‚¬Å¡Ãƒâ€šÃ‚Â¢ÃƒÆ’Ã†â€™Ãƒâ€ Ã¢â‚¬â„¢ÃƒÆ’Ã¢â‚¬Å¡Ãƒâ€šÃ‚Â¢ÃƒÆ’Ã†â€™Ãƒâ€šÃ‚Â¢ÃƒÆ’Ã‚Â¢ÃƒÂ¢Ã¢â€šÂ¬Ã…Â¡Ãƒâ€šÃ‚Â¬ÃƒÆ’Ã¢â‚¬Â¦Ãƒâ€šÃ‚Â¡ÃƒÆ’Ã†â€™ÃƒÂ¢Ã¢â€šÂ¬Ã…Â¡ÃƒÆ’Ã¢â‚¬Å¡Ãƒâ€šÃ‚Â¬ÃƒÆ’Ã†â€™Ãƒâ€ Ã¢â‚¬â„¢ÃƒÆ’Ã‚Â¢ÃƒÂ¢Ã¢â‚¬Å¡Ã‚Â¬Ãƒâ€šÃ‚Â¦ÃƒÆ’Ã†â€™ÃƒÂ¢Ã¢â€šÂ¬Ã…Â¡ÃƒÆ’Ã¢â‚¬Å¡Ãƒâ€šÃ‚Â¡ÃƒÆ’Ã†â€™Ãƒâ€ Ã¢â‚¬â„¢ÃƒÆ’Ã¢â‚¬Â ÃƒÂ¢Ã¢â€šÂ¬Ã¢â€žÂ¢ÃƒÆ’Ã†â€™ÃƒÂ¢Ã¢â€šÂ¬Ã‚Â ÃƒÆ’Ã‚Â¢ÃƒÂ¢Ã¢â‚¬Å¡Ã‚Â¬ÃƒÂ¢Ã¢â‚¬Å¾Ã‚Â¢ÃƒÆ’Ã†â€™Ãƒâ€ Ã¢â‚¬â„¢ÃƒÆ’Ã¢â‚¬Å¡Ãƒâ€šÃ‚Â¢ÃƒÆ’Ã†â€™Ãƒâ€šÃ‚Â¢ÃƒÆ’Ã‚Â¢ÃƒÂ¢Ã¢â‚¬Å¡Ã‚Â¬Ãƒâ€¦Ã‚Â¡ÃƒÆ’Ã¢â‚¬Å¡Ãƒâ€šÃ‚Â¬ÃƒÆ’Ã†â€™ÃƒÂ¢Ã¢â€šÂ¬Ã‚Â¦ÃƒÆ’Ã¢â‚¬Å¡Ãƒâ€šÃ‚Â¡ÃƒÆ’Ã†â€™Ãƒâ€ Ã¢â‚¬â„¢ÃƒÆ’Ã¢â‚¬Â ÃƒÂ¢Ã¢â€šÂ¬Ã¢â€žÂ¢ÃƒÆ’Ã†â€™Ãƒâ€šÃ‚Â¢ÃƒÆ’Ã‚Â¢ÃƒÂ¢Ã¢â€šÂ¬Ã…Â¡Ãƒâ€šÃ‚Â¬ÃƒÆ’Ã¢â‚¬Â¦Ãƒâ€šÃ‚Â¡ÃƒÆ’Ã†â€™Ãƒâ€ Ã¢â‚¬â„¢ÃƒÆ’Ã‚Â¢ÃƒÂ¢Ã¢â‚¬Å¡Ã‚Â¬Ãƒâ€¦Ã‚Â¡ÃƒÆ’Ã†â€™ÃƒÂ¢Ã¢â€šÂ¬Ã…Â¡ÃƒÆ’Ã¢â‚¬Å¡Ãƒâ€šÃ‚Â¬ÃƒÆ’Ã†â€™Ãƒâ€ Ã¢â‚¬â„¢ÃƒÆ’Ã¢â‚¬Â ÃƒÂ¢Ã¢â€šÂ¬Ã¢â€žÂ¢ÃƒÆ’Ã†â€™ÃƒÂ¢Ã¢â€šÂ¬Ã‚Â ÃƒÆ’Ã‚Â¢ÃƒÂ¢Ã¢â‚¬Å¡Ã‚Â¬ÃƒÂ¢Ã¢â‚¬Å¾Ã‚Â¢ÃƒÆ’Ã†â€™Ãƒâ€ Ã¢â‚¬â„¢ÃƒÆ’Ã‚Â¢ÃƒÂ¢Ã¢â‚¬Å¡Ã‚Â¬Ãƒâ€šÃ‚Â ÃƒÆ’Ã†â€™Ãƒâ€šÃ‚Â¢ÃƒÆ’Ã‚Â¢ÃƒÂ¢Ã¢â€šÂ¬Ã…Â¡Ãƒâ€šÃ‚Â¬ÃƒÆ’Ã‚Â¢ÃƒÂ¢Ã¢â€šÂ¬Ã…Â¾Ãƒâ€šÃ‚Â¢ÃƒÆ’Ã†â€™Ãƒâ€ Ã¢â‚¬â„¢ÃƒÆ’Ã¢â‚¬Â ÃƒÂ¢Ã¢â€šÂ¬Ã¢â€žÂ¢ÃƒÆ’Ã†â€™Ãƒâ€šÃ‚Â¢ÃƒÆ’Ã‚Â¢ÃƒÂ¢Ã¢â€šÂ¬Ã…Â¡Ãƒâ€šÃ‚Â¬ÃƒÆ’Ã¢â‚¬Å¡Ãƒâ€šÃ‚Â ÃƒÆ’Ã†â€™Ãƒâ€ Ã¢â‚¬â„¢ÃƒÆ’Ã¢â‚¬Å¡Ãƒâ€šÃ‚Â¢ÃƒÆ’Ã†â€™Ãƒâ€šÃ‚Â¢ÃƒÆ’Ã‚Â¢ÃƒÂ¢Ã¢â‚¬Å¡Ã‚Â¬Ãƒâ€¦Ã‚Â¡ÃƒÆ’Ã¢â‚¬Å¡Ãƒâ€šÃ‚Â¬ÃƒÆ’Ã†â€™Ãƒâ€šÃ‚Â¢ÃƒÆ’Ã‚Â¢ÃƒÂ¢Ã¢â‚¬Å¡Ã‚Â¬Ãƒâ€¦Ã‚Â¾ÃƒÆ’Ã¢â‚¬Å¡Ãƒâ€šÃ‚Â¢ÃƒÆ’Ã†â€™Ãƒâ€ Ã¢â‚¬â„¢ÃƒÆ’Ã¢â‚¬Â ÃƒÂ¢Ã¢â€šÂ¬Ã¢â€žÂ¢ÃƒÆ’Ã†â€™ÃƒÂ¢Ã¢â€šÂ¬Ã‚Â ÃƒÆ’Ã‚Â¢ÃƒÂ¢Ã¢â‚¬Å¡Ã‚Â¬ÃƒÂ¢Ã¢â‚¬Å¾Ã‚Â¢ÃƒÆ’Ã†â€™Ãƒâ€ Ã¢â‚¬â„¢ÃƒÆ’Ã¢â‚¬Å¡Ãƒâ€šÃ‚Â¢ÃƒÆ’Ã†â€™Ãƒâ€šÃ‚Â¢ÃƒÆ’Ã‚Â¢ÃƒÂ¢Ã¢â‚¬Å¡Ã‚Â¬Ãƒâ€¦Ã‚Â¡ÃƒÆ’Ã¢â‚¬Å¡Ãƒâ€šÃ‚Â¬ÃƒÆ’Ã†â€™ÃƒÂ¢Ã¢â€šÂ¬Ã‚Â¦ÃƒÆ’Ã¢â‚¬Å¡Ãƒâ€šÃ‚Â¡ÃƒÆ’Ã†â€™Ãƒâ€ Ã¢â‚¬â„¢ÃƒÆ’Ã¢â‚¬Â ÃƒÂ¢Ã¢â€šÂ¬Ã¢â€žÂ¢ÃƒÆ’Ã†â€™Ãƒâ€šÃ‚Â¢ÃƒÆ’Ã‚Â¢ÃƒÂ¢Ã¢â€šÂ¬Ã…Â¡Ãƒâ€šÃ‚Â¬ÃƒÆ’Ã¢â‚¬Â¦Ãƒâ€šÃ‚Â¡ÃƒÆ’Ã†â€™Ãƒâ€ Ã¢â‚¬â„¢ÃƒÆ’Ã‚Â¢ÃƒÂ¢Ã¢â‚¬Å¡Ã‚Â¬Ãƒâ€¦Ã‚Â¡ÃƒÆ’Ã†â€™ÃƒÂ¢Ã¢â€šÂ¬Ã…Â¡ÃƒÆ’Ã¢â‚¬Å¡Ãƒâ€šÃ‚Â¢ÃƒÆ’Ã†â€™Ãƒâ€ Ã¢â‚¬â„¢ÃƒÆ’Ã¢â‚¬Â ÃƒÂ¢Ã¢â€šÂ¬Ã¢â€žÂ¢ÃƒÆ’Ã†â€™ÃƒÂ¢Ã¢â€šÂ¬Ã‚Â ÃƒÆ’Ã‚Â¢ÃƒÂ¢Ã¢â‚¬Å¡Ã‚Â¬ÃƒÂ¢Ã¢â‚¬Å¾Ã‚Â¢ÃƒÆ’Ã†â€™Ãƒâ€ Ã¢â‚¬â„¢ÃƒÆ’Ã‚Â¢ÃƒÂ¢Ã¢â‚¬Å¡Ã‚Â¬Ãƒâ€šÃ‚Â ÃƒÆ’Ã†â€™Ãƒâ€šÃ‚Â¢ÃƒÆ’Ã‚Â¢ÃƒÂ¢Ã¢â€šÂ¬Ã…Â¡Ãƒâ€šÃ‚Â¬ÃƒÆ’Ã‚Â¢ÃƒÂ¢Ã¢â€šÂ¬Ã…Â¾Ãƒâ€šÃ‚Â¢ÃƒÆ’Ã†â€™Ãƒâ€ Ã¢â‚¬â„¢ÃƒÆ’Ã¢â‚¬Â ÃƒÂ¢Ã¢â€šÂ¬Ã¢â€žÂ¢ÃƒÆ’Ã†â€™Ãƒâ€šÃ‚Â¢ÃƒÆ’Ã‚Â¢ÃƒÂ¢Ã¢â€šÂ¬Ã…Â¡Ãƒâ€šÃ‚Â¬ÃƒÆ’Ã¢â‚¬Â¦Ãƒâ€šÃ‚Â¡ÃƒÆ’Ã†â€™Ãƒâ€ Ã¢â‚¬â„¢ÃƒÆ’Ã‚Â¢ÃƒÂ¢Ã¢â‚¬Å¡Ã‚Â¬Ãƒâ€¦Ã‚Â¡ÃƒÆ’Ã†â€™ÃƒÂ¢Ã¢â€šÂ¬Ã…Â¡ÃƒÆ’Ã¢â‚¬Å¡Ãƒâ€šÃ‚Â¢ÃƒÆ’Ã†â€™Ãƒâ€ Ã¢â‚¬â„¢ÃƒÆ’Ã¢â‚¬Â ÃƒÂ¢Ã¢â€šÂ¬Ã¢â€žÂ¢ÃƒÆ’Ã†â€™ÃƒÂ¢Ã¢â€šÂ¬Ã‚Â ÃƒÆ’Ã‚Â¢ÃƒÂ¢Ã¢â‚¬Å¡Ã‚Â¬ÃƒÂ¢Ã¢â‚¬Å¾Ã‚Â¢ÃƒÆ’Ã†â€™Ãƒâ€ Ã¢â‚¬â„¢ÃƒÆ’Ã‚Â¢ÃƒÂ¢Ã¢â‚¬Å¡Ã‚Â¬Ãƒâ€¦Ã‚Â¡ÃƒÆ’Ã†â€™ÃƒÂ¢Ã¢â€šÂ¬Ã…Â¡ÃƒÆ’Ã¢â‚¬Å¡Ãƒâ€šÃ‚Â¢ÃƒÆ’Ã†â€™Ãƒâ€ Ã¢â‚¬â„¢ÃƒÆ’Ã¢â‚¬Â ÃƒÂ¢Ã¢â€šÂ¬Ã¢â€žÂ¢ÃƒÆ’Ã†â€™ÃƒÂ¢Ã¢â€šÂ¬Ã…Â¡ÃƒÆ’Ã¢â‚¬Å¡Ãƒâ€šÃ‚Â¢ÃƒÆ’Ã†â€™Ãƒâ€ Ã¢â‚¬â„¢ÃƒÆ’Ã¢â‚¬Å¡Ãƒâ€šÃ‚Â¢ÃƒÆ’Ã†â€™Ãƒâ€šÃ‚Â¢ÃƒÆ’Ã‚Â¢ÃƒÂ¢Ã¢â‚¬Å¡Ã‚Â¬Ãƒâ€¦Ã‚Â¡ÃƒÆ’Ã¢â‚¬Å¡Ãƒâ€šÃ‚Â¬ÃƒÆ’Ã†â€™ÃƒÂ¢Ã¢â€šÂ¬Ã‚Â¦ÃƒÆ’Ã¢â‚¬Å¡Ãƒâ€šÃ‚Â¡ÃƒÆ’Ã†â€™Ãƒâ€ Ã¢â‚¬â„¢ÃƒÆ’Ã‚Â¢ÃƒÂ¢Ã¢â‚¬Å¡Ã‚Â¬Ãƒâ€¦Ã‚Â¡ÃƒÆ’Ã†â€™ÃƒÂ¢Ã¢â€šÂ¬Ã…Â¡ÃƒÆ’Ã¢â‚¬Å¡Ãƒâ€šÃ‚Â¬ÃƒÆ’Ã†â€™Ãƒâ€ Ã¢â‚¬â„¢ÃƒÆ’Ã¢â‚¬Â ÃƒÂ¢Ã¢â€šÂ¬Ã¢â€žÂ¢ÃƒÆ’Ã†â€™Ãƒâ€šÃ‚Â¢ÃƒÆ’Ã‚Â¢ÃƒÂ¢Ã¢â€šÂ¬Ã…Â¡Ãƒâ€šÃ‚Â¬ÃƒÆ’Ã¢â‚¬Å¡Ãƒâ€šÃ‚Â¦ÃƒÆ’Ã†â€™Ãƒâ€ Ã¢â‚¬â„¢ÃƒÆ’Ã‚Â¢ÃƒÂ¢Ã¢â‚¬Å¡Ã‚Â¬Ãƒâ€¦Ã‚Â¡ÃƒÆ’Ã†â€™ÃƒÂ¢Ã¢â€šÂ¬Ã…Â¡ÃƒÆ’Ã¢â‚¬Å¡Ãƒâ€šÃ‚Â¡ÃƒÆ’Ã†â€™Ãƒâ€ Ã¢â‚¬â„¢ÃƒÆ’Ã¢â‚¬Â ÃƒÂ¢Ã¢â€šÂ¬Ã¢â€žÂ¢ÃƒÆ’Ã†â€™ÃƒÂ¢Ã¢â€šÂ¬Ã‚Â ÃƒÆ’Ã‚Â¢ÃƒÂ¢Ã¢â‚¬Å¡Ã‚Â¬ÃƒÂ¢Ã¢â‚¬Å¾Ã‚Â¢ÃƒÆ’Ã†â€™Ãƒâ€ Ã¢â‚¬â„¢ÃƒÆ’Ã¢â‚¬Å¡Ãƒâ€šÃ‚Â¢ÃƒÆ’Ã†â€™Ãƒâ€šÃ‚Â¢ÃƒÆ’Ã‚Â¢ÃƒÂ¢Ã¢â‚¬Å¡Ã‚Â¬Ãƒâ€¦Ã‚Â¡ÃƒÆ’Ã¢â‚¬Å¡Ãƒâ€šÃ‚Â¬ÃƒÆ’Ã†â€™ÃƒÂ¢Ã¢â€šÂ¬Ã‚Â¦ÃƒÆ’Ã¢â‚¬Å¡Ãƒâ€šÃ‚Â¡ÃƒÆ’Ã†â€™Ãƒâ€ Ã¢â‚¬â„¢ÃƒÆ’Ã¢â‚¬Â ÃƒÂ¢Ã¢â€šÂ¬Ã¢â€žÂ¢ÃƒÆ’Ã†â€™Ãƒâ€šÃ‚Â¢ÃƒÆ’Ã‚Â¢ÃƒÂ¢Ã¢â€šÂ¬Ã…Â¡Ãƒâ€šÃ‚Â¬ÃƒÆ’Ã¢â‚¬Â¦Ãƒâ€šÃ‚Â¡ÃƒÆ’Ã†â€™Ãƒâ€ Ã¢â‚¬â„¢ÃƒÆ’Ã‚Â¢ÃƒÂ¢Ã¢â‚¬Å¡Ã‚Â¬Ãƒâ€¦Ã‚Â¡ÃƒÆ’Ã†â€™ÃƒÂ¢Ã¢â€šÂ¬Ã…Â¡ÃƒÆ’Ã¢â‚¬Å¡Ãƒâ€šÃ‚Â¬ÃƒÆ’Ã†â€™Ãƒâ€ Ã¢â‚¬â„¢ÃƒÆ’Ã¢â‚¬Â ÃƒÂ¢Ã¢â€šÂ¬Ã¢â€žÂ¢ÃƒÆ’Ã†â€™ÃƒÂ¢Ã¢â€šÂ¬Ã‚Â ÃƒÆ’Ã‚Â¢ÃƒÂ¢Ã¢â‚¬Å¡Ã‚Â¬ÃƒÂ¢Ã¢â‚¬Å¾Ã‚Â¢ÃƒÆ’Ã†â€™Ãƒâ€ Ã¢â‚¬â„¢ÃƒÆ’Ã‚Â¢ÃƒÂ¢Ã¢â‚¬Å¡Ã‚Â¬Ãƒâ€šÃ‚Â ÃƒÆ’Ã†â€™Ãƒâ€šÃ‚Â¢ÃƒÆ’Ã‚Â¢ÃƒÂ¢Ã¢â€šÂ¬Ã…Â¡Ãƒâ€šÃ‚Â¬ÃƒÆ’Ã‚Â¢ÃƒÂ¢Ã¢â€šÂ¬Ã…Â¾Ãƒâ€šÃ‚Â¢ÃƒÆ’Ã†â€™Ãƒâ€ Ã¢â‚¬â„¢ÃƒÆ’Ã¢â‚¬Â ÃƒÂ¢Ã¢â€šÂ¬Ã¢â€žÂ¢ÃƒÆ’Ã†â€™ÃƒÂ¢Ã¢â€šÂ¬Ã…Â¡ÃƒÆ’Ã¢â‚¬Å¡Ãƒâ€šÃ‚Â¢ÃƒÆ’Ã†â€™Ãƒâ€ Ã¢â‚¬â„¢ÃƒÆ’Ã¢â‚¬Å¡Ãƒâ€šÃ‚Â¢ÃƒÆ’Ã†â€™Ãƒâ€šÃ‚Â¢ÃƒÆ’Ã‚Â¢ÃƒÂ¢Ã¢â€šÂ¬Ã…Â¡Ãƒâ€šÃ‚Â¬ÃƒÆ’Ã¢â‚¬Â¦Ãƒâ€šÃ‚Â¡ÃƒÆ’Ã†â€™ÃƒÂ¢Ã¢â€šÂ¬Ã…Â¡ÃƒÆ’Ã¢â‚¬Å¡Ãƒâ€šÃ‚Â¬ÃƒÆ’Ã†â€™Ãƒâ€ Ã¢â‚¬â„¢ÃƒÆ’Ã‚Â¢ÃƒÂ¢Ã¢â‚¬Å¡Ã‚Â¬Ãƒâ€¦Ã‚Â¡ÃƒÆ’Ã†â€™ÃƒÂ¢Ã¢â€šÂ¬Ã…Â¡ÃƒÆ’Ã¢â‚¬Å¡Ãƒâ€šÃ‚Â¦ÃƒÆ’Ã†â€™Ãƒâ€ Ã¢â‚¬â„¢ÃƒÆ’Ã¢â‚¬Â ÃƒÂ¢Ã¢â€šÂ¬Ã¢â€žÂ¢ÃƒÆ’Ã†â€™ÃƒÂ¢Ã¢â€šÂ¬Ã‚Â ÃƒÆ’Ã‚Â¢ÃƒÂ¢Ã¢â‚¬Å¡Ã‚Â¬ÃƒÂ¢Ã¢â‚¬Å¾Ã‚Â¢ÃƒÆ’Ã†â€™Ãƒâ€ Ã¢â‚¬â„¢ÃƒÆ’Ã‚Â¢ÃƒÂ¢Ã¢â‚¬Å¡Ã‚Â¬Ãƒâ€¦Ã‚Â¡ÃƒÆ’Ã†â€™ÃƒÂ¢Ã¢â€šÂ¬Ã…Â¡ÃƒÆ’Ã¢â‚¬Å¡Ãƒâ€šÃ‚Â¢ÃƒÆ’Ã†â€™Ãƒâ€ Ã¢â‚¬â„¢ÃƒÆ’Ã¢â‚¬Â ÃƒÂ¢Ã¢â€šÂ¬Ã¢â€žÂ¢ÃƒÆ’Ã†â€™ÃƒÂ¢Ã¢â€šÂ¬Ã…Â¡ÃƒÆ’Ã¢â‚¬Å¡Ãƒâ€šÃ‚Â¢ÃƒÆ’Ã†â€™Ãƒâ€ Ã¢â‚¬â„¢ÃƒÆ’Ã¢â‚¬Å¡Ãƒâ€šÃ‚Â¢ÃƒÆ’Ã†â€™Ãƒâ€šÃ‚Â¢ÃƒÆ’Ã‚Â¢ÃƒÂ¢Ã¢â‚¬Å¡Ã‚Â¬Ãƒâ€¦Ã‚Â¡ÃƒÆ’Ã¢â‚¬Å¡Ãƒâ€šÃ‚Â¬ÃƒÆ’Ã†â€™ÃƒÂ¢Ã¢â€šÂ¬Ã‚Â¦ÃƒÆ’Ã¢â‚¬Å¡Ãƒâ€šÃ‚Â¡ÃƒÆ’Ã†â€™Ãƒâ€ Ã¢â‚¬â„¢ÃƒÆ’Ã‚Â¢ÃƒÂ¢Ã¢â‚¬Å¡Ã‚Â¬Ãƒâ€¦Ã‚Â¡ÃƒÆ’Ã†â€™ÃƒÂ¢Ã¢â€šÂ¬Ã…Â¡ÃƒÆ’Ã¢â‚¬Å¡Ãƒâ€šÃ‚Â¬ÃƒÆ’Ã†â€™Ãƒâ€ Ã¢â‚¬â„¢ÃƒÆ’Ã¢â‚¬Â ÃƒÂ¢Ã¢â€šÂ¬Ã¢â€žÂ¢ÃƒÆ’Ã†â€™Ãƒâ€šÃ‚Â¢ÃƒÆ’Ã‚Â¢ÃƒÂ¢Ã¢â€šÂ¬Ã…Â¡Ãƒâ€šÃ‚Â¬ÃƒÆ’Ã¢â‚¬Å¡Ãƒâ€šÃ‚Â¦ÃƒÆ’Ã†â€™Ãƒâ€ Ã¢â‚¬â„¢ÃƒÆ’Ã¢â‚¬Å¡Ãƒâ€šÃ‚Â¢ÃƒÆ’Ã†â€™Ãƒâ€šÃ‚Â¢ÃƒÆ’Ã‚Â¢ÃƒÂ¢Ã¢â‚¬Å¡Ã‚Â¬Ãƒâ€¦Ã‚Â¡ÃƒÆ’Ã¢â‚¬Å¡Ãƒâ€šÃ‚Â¬ÃƒÆ’Ã†â€™ÃƒÂ¢Ã¢â€šÂ¬Ã‚Â¦ÃƒÆ’Ã‚Â¢ÃƒÂ¢Ã¢â‚¬Å¡Ã‚Â¬Ãƒâ€¦Ã¢â‚¬Å“Wk3), both treatments recorded negative growth rates, with the IMTA system showing a sharper decline (-5.953 g/day) compared to the Monoculture (-2.916 g/day). During the recovery phase (Wk3ÃƒÆ’Ã†â€™Ãƒâ€ Ã¢â‚¬â„¢ÃƒÆ’Ã¢â‚¬Â ÃƒÂ¢Ã¢â€šÂ¬Ã¢â€žÂ¢ÃƒÆ’Ã†â€™ÃƒÂ¢Ã¢â€šÂ¬Ã‚Â ÃƒÆ’Ã‚Â¢ÃƒÂ¢Ã¢â‚¬Å¡Ã‚Â¬ÃƒÂ¢Ã¢â‚¬Å¾Ã‚Â¢ÃƒÆ’Ã†â€™Ãƒâ€ Ã¢â‚¬â„¢ÃƒÆ’Ã‚Â¢ÃƒÂ¢Ã¢â‚¬Å¡Ã‚Â¬Ãƒâ€šÃ‚Â ÃƒÆ’Ã†â€™Ãƒâ€šÃ‚Â¢ÃƒÆ’Ã‚Â¢ÃƒÂ¢Ã¢â€šÂ¬Ã…Â¡Ãƒâ€šÃ‚Â¬ÃƒÆ’Ã‚Â¢ÃƒÂ¢Ã¢â€šÂ¬Ã…Â¾Ãƒâ€šÃ‚Â¢ÃƒÆ’Ã†â€™Ãƒâ€ Ã¢â‚¬â„¢ÃƒÆ’Ã¢â‚¬Â ÃƒÂ¢Ã¢â€šÂ¬Ã¢â€žÂ¢ÃƒÆ’Ã†â€™Ãƒâ€šÃ‚Â¢ÃƒÆ’Ã‚Â¢ÃƒÂ¢Ã¢â€šÂ¬Ã…Â¡Ãƒâ€šÃ‚Â¬ÃƒÆ’Ã¢â‚¬Å¡Ãƒâ€šÃ‚Â ÃƒÆ’Ã†â€™Ãƒâ€ Ã¢â‚¬â„¢ÃƒÆ’Ã¢â‚¬Å¡Ãƒâ€šÃ‚Â¢ÃƒÆ’Ã†â€™Ãƒâ€šÃ‚Â¢ÃƒÆ’Ã‚Â¢ÃƒÂ¢Ã¢â‚¬Å¡Ã‚Â¬Ãƒâ€¦Ã‚Â¡ÃƒÆ’Ã¢â‚¬Å¡Ãƒâ€šÃ‚Â¬ÃƒÆ’Ã†â€™Ãƒâ€šÃ‚Â¢ÃƒÆ’Ã‚Â¢ÃƒÂ¢Ã¢â‚¬Å¡Ã‚Â¬Ãƒâ€¦Ã‚Â¾ÃƒÆ’Ã¢â‚¬Å¡Ãƒâ€šÃ‚Â¢ÃƒÆ’Ã†â€™Ãƒâ€ Ã¢â‚¬â„¢ÃƒÆ’Ã¢â‚¬Â ÃƒÂ¢Ã¢â€šÂ¬Ã¢â€žÂ¢ÃƒÆ’Ã†â€™ÃƒÂ¢Ã¢â€šÂ¬Ã‚Â ÃƒÆ’Ã‚Â¢ÃƒÂ¢Ã¢â‚¬Å¡Ã‚Â¬ÃƒÂ¢Ã¢â‚¬Å¾Ã‚Â¢ÃƒÆ’Ã†â€™Ãƒâ€ Ã¢â‚¬â„¢ÃƒÆ’Ã¢â‚¬Å¡Ãƒâ€šÃ‚Â¢ÃƒÆ’Ã†â€™Ãƒâ€šÃ‚Â¢ÃƒÆ’Ã‚Â¢ÃƒÂ¢Ã¢â‚¬Å¡Ã‚Â¬Ãƒâ€¦Ã‚Â¡ÃƒÆ’Ã¢â‚¬Å¡Ãƒâ€šÃ‚Â¬ÃƒÆ’Ã†â€™ÃƒÂ¢Ã¢â€šÂ¬Ã…Â¡ÃƒÆ’Ã¢â‚¬Å¡Ãƒâ€šÃ‚Â ÃƒÆ’Ã†â€™Ãƒâ€ Ã¢â‚¬â„¢ÃƒÆ’Ã¢â‚¬Â ÃƒÂ¢Ã¢â€šÂ¬Ã¢â€žÂ¢ÃƒÆ’Ã†â€™ÃƒÂ¢Ã¢â€šÂ¬Ã…Â¡ÃƒÆ’Ã¢â‚¬Å¡Ãƒâ€šÃ‚Â¢ÃƒÆ’Ã†â€™Ãƒâ€ Ã¢â‚¬â„¢ÃƒÆ’Ã¢â‚¬Å¡Ãƒâ€šÃ‚Â¢ÃƒÆ’Ã†â€™Ãƒâ€šÃ‚Â¢ÃƒÆ’Ã‚Â¢ÃƒÂ¢Ã¢â€šÂ¬Ã…Â¡Ãƒâ€šÃ‚Â¬ÃƒÆ’Ã¢â‚¬Â¦Ãƒâ€šÃ‚Â¡ÃƒÆ’Ã†â€™ÃƒÂ¢Ã¢â€šÂ¬Ã…Â¡ÃƒÆ’Ã¢â‚¬Å¡Ãƒâ€šÃ‚Â¬ÃƒÆ’Ã†â€™Ãƒâ€ Ã¢â‚¬â„¢ÃƒÆ’Ã¢â‚¬Å¡Ãƒâ€šÃ‚Â¢ÃƒÆ’Ã†â€™Ãƒâ€šÃ‚Â¢ÃƒÆ’Ã‚Â¢ÃƒÂ¢Ã¢â€šÂ¬Ã…Â¡Ãƒâ€šÃ‚Â¬ÃƒÆ’Ã¢â‚¬Â¦Ãƒâ€šÃ‚Â¾ÃƒÆ’Ã†â€™ÃƒÂ¢Ã¢â€šÂ¬Ã…Â¡ÃƒÆ’Ã¢â‚¬Å¡Ãƒâ€šÃ‚Â¢ÃƒÆ’Ã†â€™Ãƒâ€ Ã¢â‚¬â„¢ÃƒÆ’Ã¢â‚¬Â ÃƒÂ¢Ã¢â€šÂ¬Ã¢â€žÂ¢ÃƒÆ’Ã†â€™ÃƒÂ¢Ã¢â€šÂ¬Ã‚Â ÃƒÆ’Ã‚Â¢ÃƒÂ¢Ã¢â‚¬Å¡Ã‚Â¬ÃƒÂ¢Ã¢â‚¬Å¾Ã‚Â¢ÃƒÆ’Ã†â€™Ãƒâ€ Ã¢â‚¬â„¢ÃƒÆ’Ã‚Â¢ÃƒÂ¢Ã¢â‚¬Å¡Ã‚Â¬Ãƒâ€šÃ‚Â ÃƒÆ’Ã†â€™Ãƒâ€šÃ‚Â¢ÃƒÆ’Ã‚Â¢ÃƒÂ¢Ã¢â€šÂ¬Ã…Â¡Ãƒâ€šÃ‚Â¬ÃƒÆ’Ã‚Â¢ÃƒÂ¢Ã¢â€šÂ¬Ã…Â¾Ãƒâ€šÃ‚Â¢ÃƒÆ’Ã†â€™Ãƒâ€ Ã¢â‚¬â„¢ÃƒÆ’Ã¢â‚¬Â ÃƒÂ¢Ã¢â€šÂ¬Ã¢â€žÂ¢ÃƒÆ’Ã†â€™ÃƒÂ¢Ã¢â€šÂ¬Ã…Â¡ÃƒÆ’Ã¢â‚¬Å¡Ãƒâ€šÃ‚Â¢ÃƒÆ’Ã†â€™Ãƒâ€ Ã¢â‚¬â„¢ÃƒÆ’Ã¢â‚¬Å¡Ãƒâ€šÃ‚Â¢ÃƒÆ’Ã†â€™Ãƒâ€šÃ‚Â¢ÃƒÆ’Ã‚Â¢ÃƒÂ¢Ã¢â€šÂ¬Ã…Â¡Ãƒâ€šÃ‚Â¬ÃƒÆ’Ã¢â‚¬Â¦Ãƒâ€šÃ‚Â¡ÃƒÆ’Ã†â€™ÃƒÂ¢Ã¢â€šÂ¬Ã…Â¡ÃƒÆ’Ã¢â‚¬Å¡Ãƒâ€šÃ‚Â¬ÃƒÆ’Ã†â€™Ãƒâ€ Ã¢â‚¬â„¢ÃƒÆ’Ã‚Â¢ÃƒÂ¢Ã¢â‚¬Å¡Ã‚Â¬Ãƒâ€šÃ‚Â¦ÃƒÆ’Ã†â€™ÃƒÂ¢Ã¢â€šÂ¬Ã…Â¡ÃƒÆ’Ã¢â‚¬Å¡Ãƒâ€šÃ‚Â¡ÃƒÆ’Ã†â€™Ãƒâ€ Ã¢â‚¬â„¢ÃƒÆ’Ã¢â‚¬Â ÃƒÂ¢Ã¢â€šÂ¬Ã¢â€žÂ¢ÃƒÆ’Ã†â€™ÃƒÂ¢Ã¢â€šÂ¬Ã‚Â ÃƒÆ’Ã‚Â¢ÃƒÂ¢Ã¢â‚¬Å¡Ã‚Â¬ÃƒÂ¢Ã¢â‚¬Å¾Ã‚Â¢ÃƒÆ’Ã†â€™Ãƒâ€ Ã¢â‚¬â„¢ÃƒÆ’Ã¢â‚¬Å¡Ãƒâ€šÃ‚Â¢ÃƒÆ’Ã†â€™Ãƒâ€šÃ‚Â¢ÃƒÆ’Ã‚Â¢ÃƒÂ¢Ã¢â‚¬Å¡Ã‚Â¬Ãƒâ€¦Ã‚Â¡ÃƒÆ’Ã¢â‚¬Å¡Ãƒâ€šÃ‚Â¬ÃƒÆ’Ã†â€™ÃƒÂ¢Ã¢â€šÂ¬Ã‚Â¦ÃƒÆ’Ã¢â‚¬Å¡Ãƒâ€šÃ‚Â¡ÃƒÆ’Ã†â€™Ãƒâ€ Ã¢â‚¬â„¢ÃƒÆ’Ã¢â‚¬Â ÃƒÂ¢Ã¢â€šÂ¬Ã¢â€žÂ¢ÃƒÆ’Ã†â€™Ãƒâ€šÃ‚Â¢ÃƒÆ’Ã‚Â¢ÃƒÂ¢Ã¢â€šÂ¬Ã…Â¡Ãƒâ€šÃ‚Â¬ÃƒÆ’Ã¢â‚¬Â¦Ãƒâ€šÃ‚Â¡ÃƒÆ’Ã†â€™Ãƒâ€ Ã¢â‚¬â„¢ÃƒÆ’Ã‚Â¢ÃƒÂ¢Ã¢â‚¬Å¡Ã‚Â¬Ãƒâ€¦Ã‚Â¡ÃƒÆ’Ã†â€™ÃƒÂ¢Ã¢â€šÂ¬Ã…Â¡ÃƒÆ’Ã¢â‚¬Å¡Ãƒâ€šÃ‚Â¢ÃƒÆ’Ã†â€™Ãƒâ€ Ã¢â‚¬â„¢ÃƒÆ’Ã¢â‚¬Â ÃƒÂ¢Ã¢â€šÂ¬Ã¢â€žÂ¢ÃƒÆ’Ã†â€™ÃƒÂ¢Ã¢â€šÂ¬Ã‚Â ÃƒÆ’Ã‚Â¢ÃƒÂ¢Ã¢â‚¬Å¡Ã‚Â¬ÃƒÂ¢Ã¢â‚¬Å¾Ã‚Â¢ÃƒÆ’Ã†â€™Ãƒâ€ Ã¢â‚¬â„¢ÃƒÆ’Ã‚Â¢ÃƒÂ¢Ã¢â‚¬Å¡Ã‚Â¬Ãƒâ€šÃ‚Â ÃƒÆ’Ã†â€™Ãƒâ€šÃ‚Â¢ÃƒÆ’Ã‚Â¢ÃƒÂ¢Ã¢â€šÂ¬Ã…Â¡Ãƒâ€šÃ‚Â¬ÃƒÆ’Ã‚Â¢ÃƒÂ¢Ã¢â€šÂ¬Ã…Â¾Ãƒâ€šÃ‚Â¢ÃƒÆ’Ã†â€™Ãƒâ€ Ã¢â‚¬â„¢ÃƒÆ’Ã¢â‚¬Â ÃƒÂ¢Ã¢â€šÂ¬Ã¢â€žÂ¢ÃƒÆ’Ã†â€™Ãƒâ€šÃ‚Â¢ÃƒÆ’Ã‚Â¢ÃƒÂ¢Ã¢â€šÂ¬Ã…Â¡Ãƒâ€šÃ‚Â¬ÃƒÆ’Ã¢â‚¬Å¡Ãƒâ€šÃ‚Â ÃƒÆ’Ã†â€™Ãƒâ€ Ã¢â‚¬â„¢ÃƒÆ’Ã¢â‚¬Å¡Ãƒâ€šÃ‚Â¢ÃƒÆ’Ã†â€™Ãƒâ€šÃ‚Â¢ÃƒÆ’Ã‚Â¢ÃƒÂ¢Ã¢â‚¬Å¡Ã‚Â¬Ãƒâ€¦Ã‚Â¡ÃƒÆ’Ã¢â‚¬Å¡Ãƒâ€šÃ‚Â¬ÃƒÆ’Ã†â€™Ãƒâ€šÃ‚Â¢ÃƒÆ’Ã‚Â¢ÃƒÂ¢Ã¢â‚¬Å¡Ã‚Â¬Ãƒâ€¦Ã‚Â¾ÃƒÆ’Ã¢â‚¬Å¡Ãƒâ€šÃ‚Â¢ÃƒÆ’Ã†â€™Ãƒâ€ Ã¢â‚¬â„¢ÃƒÆ’Ã¢â‚¬Â ÃƒÂ¢Ã¢â€šÂ¬Ã¢â€žÂ¢ÃƒÆ’Ã†â€™ÃƒÂ¢Ã¢â€šÂ¬Ã‚Â ÃƒÆ’Ã‚Â¢ÃƒÂ¢Ã¢â‚¬Å¡Ã‚Â¬ÃƒÂ¢Ã¢â‚¬Å¾Ã‚Â¢ÃƒÆ’Ã†â€™Ãƒâ€ Ã¢â‚¬â„¢ÃƒÆ’Ã¢â‚¬Å¡Ãƒâ€šÃ‚Â¢ÃƒÆ’Ã†â€™Ãƒâ€šÃ‚Â¢ÃƒÆ’Ã‚Â¢ÃƒÂ¢Ã¢â‚¬Å¡Ã‚Â¬Ãƒâ€¦Ã‚Â¡ÃƒÆ’Ã¢â‚¬Å¡Ãƒâ€šÃ‚Â¬ÃƒÆ’Ã†â€™ÃƒÂ¢Ã¢â€šÂ¬Ã‚Â¦ÃƒÆ’Ã¢â‚¬Å¡Ãƒâ€šÃ‚Â¡ÃƒÆ’Ã†â€™Ãƒâ€ Ã¢â‚¬â„¢ÃƒÆ’Ã¢â‚¬Â ÃƒÂ¢Ã¢â€šÂ¬Ã¢â€žÂ¢ÃƒÆ’Ã†â€™Ãƒâ€šÃ‚Â¢ÃƒÆ’Ã‚Â¢ÃƒÂ¢Ã¢â€šÂ¬Ã…Â¡Ãƒâ€šÃ‚Â¬ÃƒÆ’Ã¢â‚¬Â¦Ãƒâ€šÃ‚Â¡ÃƒÆ’Ã†â€™Ãƒâ€ Ã¢â‚¬â„¢ÃƒÆ’Ã‚Â¢ÃƒÂ¢Ã¢â‚¬Å¡Ã‚Â¬Ãƒâ€¦Ã‚Â¡ÃƒÆ’Ã†â€™ÃƒÂ¢Ã¢â€šÂ¬Ã…Â¡ÃƒÆ’Ã¢â‚¬Å¡Ãƒâ€šÃ‚Â¢ÃƒÆ’Ã†â€™Ãƒâ€ Ã¢â‚¬â„¢ÃƒÆ’Ã¢â‚¬Â ÃƒÂ¢Ã¢â€šÂ¬Ã¢â€žÂ¢ÃƒÆ’Ã†â€™ÃƒÂ¢Ã¢â€šÂ¬Ã‚Â ÃƒÆ’Ã‚Â¢ÃƒÂ¢Ã¢â‚¬Å¡Ã‚Â¬ÃƒÂ¢Ã¢â‚¬Å¾Ã‚Â¢ÃƒÆ’Ã†â€™Ãƒâ€ Ã¢â‚¬â„¢ÃƒÆ’Ã‚Â¢ÃƒÂ¢Ã¢â‚¬Å¡Ã‚Â¬Ãƒâ€šÃ‚Â ÃƒÆ’Ã†â€™Ãƒâ€šÃ‚Â¢ÃƒÆ’Ã‚Â¢ÃƒÂ¢Ã¢â€šÂ¬Ã…Â¡Ãƒâ€šÃ‚Â¬ÃƒÆ’Ã‚Â¢ÃƒÂ¢Ã¢â€šÂ¬Ã…Â¾Ãƒâ€šÃ‚Â¢ÃƒÆ’Ã†â€™Ãƒâ€ Ã¢â‚¬â„¢ÃƒÆ’Ã¢â‚¬Â ÃƒÂ¢Ã¢â€šÂ¬Ã¢â€žÂ¢ÃƒÆ’Ã†â€™Ãƒâ€šÃ‚Â¢ÃƒÆ’Ã‚Â¢ÃƒÂ¢Ã¢â€šÂ¬Ã…Â¡Ãƒâ€šÃ‚Â¬ÃƒÆ’Ã¢â‚¬Â¦Ãƒâ€šÃ‚Â¡ÃƒÆ’Ã†â€™Ãƒâ€ Ã¢â‚¬â„¢ÃƒÆ’Ã‚Â¢ÃƒÂ¢Ã¢â‚¬Å¡Ã‚Â¬Ãƒâ€¦Ã‚Â¡ÃƒÆ’Ã†â€™ÃƒÂ¢Ã¢â€šÂ¬Ã…Â¡ÃƒÆ’Ã¢â‚¬Å¡Ãƒâ€šÃ‚Â¢ÃƒÆ’Ã†â€™Ãƒâ€ Ã¢â‚¬â„¢ÃƒÆ’Ã¢â‚¬Â ÃƒÂ¢Ã¢â€šÂ¬Ã¢â€žÂ¢ÃƒÆ’Ã†â€™ÃƒÂ¢Ã¢â€šÂ¬Ã‚Â ÃƒÆ’Ã‚Â¢ÃƒÂ¢Ã¢â‚¬Å¡Ã‚Â¬ÃƒÂ¢Ã¢â‚¬Å¾Ã‚Â¢ÃƒÆ’Ã†â€™Ãƒâ€ Ã¢â‚¬â„¢ÃƒÆ’Ã‚Â¢ÃƒÂ¢Ã¢â‚¬Å¡Ã‚Â¬Ãƒâ€¦Ã‚Â¡ÃƒÆ’Ã†â€™ÃƒÂ¢Ã¢â€šÂ¬Ã…Â¡ÃƒÆ’Ã¢â‚¬Å¡Ãƒâ€šÃ‚Â¢ÃƒÆ’Ã†â€™Ãƒâ€ Ã¢â‚¬â„¢ÃƒÆ’Ã¢â‚¬Â ÃƒÂ¢Ã¢â€šÂ¬Ã¢â€žÂ¢ÃƒÆ’Ã†â€™ÃƒÂ¢Ã¢â€šÂ¬Ã…Â¡ÃƒÆ’Ã¢â‚¬Å¡Ãƒâ€šÃ‚Â¢ÃƒÆ’Ã†â€™Ãƒâ€ Ã¢â‚¬â„¢ÃƒÆ’Ã¢â‚¬Å¡Ãƒâ€šÃ‚Â¢ÃƒÆ’Ã†â€™Ãƒâ€šÃ‚Â¢ÃƒÆ’Ã‚Â¢ÃƒÂ¢Ã¢â€šÂ¬Ã…Â¡Ãƒâ€šÃ‚Â¬ÃƒÆ’Ã¢â‚¬Â¦Ãƒâ€šÃ‚Â¡ÃƒÆ’Ã†â€™ÃƒÂ¢Ã¢â€šÂ¬Ã…Â¡ÃƒÆ’Ã¢â‚¬Å¡Ãƒâ€šÃ‚Â¬ÃƒÆ’Ã†â€™Ãƒâ€ Ã¢â‚¬â„¢ÃƒÆ’Ã‚Â¢ÃƒÂ¢Ã¢â‚¬Å¡Ã‚Â¬Ãƒâ€šÃ‚Â¦ÃƒÆ’Ã†â€™ÃƒÂ¢Ã¢â€šÂ¬Ã…Â¡ÃƒÆ’Ã¢â‚¬Å¡Ãƒâ€šÃ‚Â¡ÃƒÆ’Ã†â€™Ãƒâ€ Ã¢â‚¬â„¢ÃƒÆ’Ã¢â‚¬Â ÃƒÂ¢Ã¢â€šÂ¬Ã¢â€žÂ¢ÃƒÆ’Ã†â€™Ãƒâ€šÃ‚Â¢ÃƒÆ’Ã‚Â¢ÃƒÂ¢Ã¢â€šÂ¬Ã…Â¡Ãƒâ€šÃ‚Â¬ÃƒÆ’Ã¢â‚¬Â¦Ãƒâ€šÃ‚Â¡ÃƒÆ’Ã†â€™Ãƒâ€ Ã¢â‚¬â„¢ÃƒÆ’Ã‚Â¢ÃƒÂ¢Ã¢â‚¬Å¡Ã‚Â¬Ãƒâ€¦Ã‚Â¡ÃƒÆ’Ã†â€™ÃƒÂ¢Ã¢â€šÂ¬Ã…Â¡ÃƒÆ’Ã¢â‚¬Å¡Ãƒâ€šÃ‚Â¬ÃƒÆ’Ã†â€™Ãƒâ€ Ã¢â‚¬â„¢ÃƒÆ’Ã¢â‚¬Â ÃƒÂ¢Ã¢â€šÂ¬Ã¢â€žÂ¢ÃƒÆ’Ã†â€™ÃƒÂ¢Ã¢â€šÂ¬Ã‚Â ÃƒÆ’Ã‚Â¢ÃƒÂ¢Ã¢â‚¬Å¡Ã‚Â¬ÃƒÂ¢Ã¢â‚¬Å¾Ã‚Â¢ÃƒÆ’Ã†â€™Ãƒâ€ Ã¢â‚¬â„¢ÃƒÆ’Ã¢â‚¬Å¡Ãƒâ€šÃ‚Â¢ÃƒÆ’Ã†â€™Ãƒâ€šÃ‚Â¢ÃƒÆ’Ã‚Â¢ÃƒÂ¢Ã¢â‚¬Å¡Ã‚Â¬Ãƒâ€¦Ã‚Â¡ÃƒÆ’Ã¢â‚¬Å¡Ãƒâ€šÃ‚Â¬ÃƒÆ’Ã†â€™ÃƒÂ¢Ã¢â€šÂ¬Ã…Â¡ÃƒÆ’Ã¢â‚¬Å¡Ãƒâ€šÃ‚Â¦ÃƒÆ’Ã†â€™Ãƒâ€ Ã¢â‚¬â„¢ÃƒÆ’Ã¢â‚¬Â ÃƒÂ¢Ã¢â€šÂ¬Ã¢â€žÂ¢ÃƒÆ’Ã†â€™Ãƒâ€šÃ‚Â¢ÃƒÆ’Ã‚Â¢ÃƒÂ¢Ã¢â€šÂ¬Ã…Â¡Ãƒâ€šÃ‚Â¬ÃƒÆ’Ã¢â‚¬Â¦Ãƒâ€šÃ‚Â¡ÃƒÆ’Ã†â€™Ãƒâ€ Ã¢â‚¬â„¢ÃƒÆ’Ã‚Â¢ÃƒÂ¢Ã¢â‚¬Å¡Ã‚Â¬Ãƒâ€¦Ã‚Â¡ÃƒÆ’Ã†â€™ÃƒÂ¢Ã¢â€šÂ¬Ã…Â¡ÃƒÆ’Ã¢â‚¬Å¡Ãƒâ€šÃ‚Â¡ÃƒÆ’Ã†â€™Ãƒâ€ Ã¢â‚¬â„¢ÃƒÆ’Ã¢â‚¬Â ÃƒÂ¢Ã¢â€šÂ¬Ã¢â€žÂ¢ÃƒÆ’Ã†â€™ÃƒÂ¢Ã¢â€šÂ¬Ã‚Â ÃƒÆ’Ã‚Â¢ÃƒÂ¢Ã¢â‚¬Å¡Ã‚Â¬ÃƒÂ¢Ã¢â‚¬Å¾Ã‚Â¢ÃƒÆ’Ã†â€™Ãƒâ€ Ã¢â‚¬â„¢ÃƒÆ’Ã‚Â¢ÃƒÂ¢Ã¢â‚¬Å¡Ã‚Â¬Ãƒâ€šÃ‚Â ÃƒÆ’Ã†â€™Ãƒâ€šÃ‚Â¢ÃƒÆ’Ã‚Â¢ÃƒÂ¢Ã¢â€šÂ¬Ã…Â¡Ãƒâ€šÃ‚Â¬ÃƒÆ’Ã‚Â¢ÃƒÂ¢Ã¢â€šÂ¬Ã…Â¾Ãƒâ€šÃ‚Â¢ÃƒÆ’Ã†â€™Ãƒâ€ Ã¢â‚¬â„¢ÃƒÆ’Ã¢â‚¬Â ÃƒÂ¢Ã¢â€šÂ¬Ã¢â€žÂ¢ÃƒÆ’Ã†â€™ÃƒÂ¢Ã¢â€šÂ¬Ã…Â¡ÃƒÆ’Ã¢â‚¬Å¡Ãƒâ€šÃ‚Â¢ÃƒÆ’Ã†â€™Ãƒâ€ Ã¢â‚¬â„¢ÃƒÆ’Ã¢â‚¬Å¡Ãƒâ€šÃ‚Â¢ÃƒÆ’Ã†â€™Ãƒâ€šÃ‚Â¢ÃƒÆ’Ã‚Â¢ÃƒÂ¢Ã¢â€šÂ¬Ã…Â¡Ãƒâ€šÃ‚Â¬ÃƒÆ’Ã¢â‚¬Â¦Ãƒâ€šÃ‚Â¡ÃƒÆ’Ã†â€™ÃƒÂ¢Ã¢â€šÂ¬Ã…Â¡ÃƒÆ’Ã¢â‚¬Å¡Ãƒâ€šÃ‚Â¬ÃƒÆ’Ã†â€™Ãƒâ€ Ã¢â‚¬â„¢ÃƒÆ’Ã‚Â¢ÃƒÂ¢Ã¢â‚¬Å¡Ã‚Â¬Ãƒâ€šÃ‚Â¦ÃƒÆ’Ã†â€™ÃƒÂ¢Ã¢â€šÂ¬Ã…Â¡ÃƒÆ’Ã¢â‚¬Å¡Ãƒâ€šÃ‚Â¡ÃƒÆ’Ã†â€™Ãƒâ€ Ã¢â‚¬â„¢ÃƒÆ’Ã¢â‚¬Â ÃƒÂ¢Ã¢â€šÂ¬Ã¢â€žÂ¢ÃƒÆ’Ã†â€™ÃƒÂ¢Ã¢â€šÂ¬Ã‚Â ÃƒÆ’Ã‚Â¢ÃƒÂ¢Ã¢â‚¬Å¡Ã‚Â¬ÃƒÂ¢Ã¢â‚¬Å¾Ã‚Â¢ÃƒÆ’Ã†â€™Ãƒâ€ Ã¢â‚¬â„¢ÃƒÆ’Ã¢â‚¬Å¡Ãƒâ€šÃ‚Â¢ÃƒÆ’Ã†â€™Ãƒâ€šÃ‚Â¢ÃƒÆ’Ã‚Â¢ÃƒÂ¢Ã¢â‚¬Å¡Ã‚Â¬Ãƒâ€¦Ã‚Â¡ÃƒÆ’Ã¢â‚¬Å¡Ãƒâ€šÃ‚Â¬ÃƒÆ’Ã†â€™ÃƒÂ¢Ã¢â€šÂ¬Ã‚Â¦ÃƒÆ’Ã¢â‚¬Å¡Ãƒâ€šÃ‚Â¡ÃƒÆ’Ã†â€™Ãƒâ€ Ã¢â‚¬â„¢ÃƒÆ’Ã¢â‚¬Â ÃƒÂ¢Ã¢â€šÂ¬Ã¢â€žÂ¢ÃƒÆ’Ã†â€™Ãƒâ€šÃ‚Â¢ÃƒÆ’Ã‚Â¢ÃƒÂ¢Ã¢â€šÂ¬Ã…Â¡Ãƒâ€šÃ‚Â¬ÃƒÆ’Ã¢â‚¬Â¦Ãƒâ€šÃ‚Â¡ÃƒÆ’Ã†â€™Ãƒâ€ Ã¢â‚¬â„¢ÃƒÆ’Ã‚Â¢ÃƒÂ¢Ã¢â‚¬Å¡Ã‚Â¬Ãƒâ€¦Ã‚Â¡ÃƒÆ’Ã†â€™ÃƒÂ¢Ã¢â€šÂ¬Ã…Â¡ÃƒÆ’Ã¢â‚¬Å¡Ãƒâ€šÃ‚Â¬ÃƒÆ’Ã†â€™Ãƒâ€ Ã¢â‚¬â„¢ÃƒÆ’Ã¢â‚¬Â ÃƒÂ¢Ã¢â€šÂ¬Ã¢â€žÂ¢ÃƒÆ’Ã†â€™ÃƒÂ¢Ã¢â€šÂ¬Ã‚Â ÃƒÆ’Ã‚Â¢ÃƒÂ¢Ã¢â‚¬Å¡Ã‚Â¬ÃƒÂ¢Ã¢â‚¬Å¾Ã‚Â¢ÃƒÆ’Ã†â€™Ãƒâ€ Ã¢â‚¬â„¢ÃƒÆ’Ã‚Â¢ÃƒÂ¢Ã¢â‚¬Å¡Ã‚Â¬Ãƒâ€šÃ‚Â ÃƒÆ’Ã†â€™Ãƒâ€šÃ‚Â¢ÃƒÆ’Ã‚Â¢ÃƒÂ¢Ã¢â€šÂ¬Ã…Â¡Ãƒâ€šÃ‚Â¬ÃƒÆ’Ã‚Â¢ÃƒÂ¢Ã¢â€šÂ¬Ã…Â¾Ãƒâ€šÃ‚Â¢ÃƒÆ’Ã†â€™Ãƒâ€ Ã¢â‚¬â„¢ÃƒÆ’Ã¢â‚¬Â ÃƒÂ¢Ã¢â€šÂ¬Ã¢â€žÂ¢ÃƒÆ’Ã†â€™Ãƒâ€šÃ‚Â¢ÃƒÆ’Ã‚Â¢ÃƒÂ¢Ã¢â€šÂ¬Ã…Â¡Ãƒâ€šÃ‚Â¬ÃƒÆ’Ã¢â‚¬Å¡Ãƒâ€šÃ‚Â ÃƒÆ’Ã†â€™Ãƒâ€ Ã¢â‚¬â„¢ÃƒÆ’Ã¢â‚¬Å¡Ãƒâ€šÃ‚Â¢ÃƒÆ’Ã†â€™Ãƒâ€šÃ‚Â¢ÃƒÆ’Ã‚Â¢ÃƒÂ¢Ã¢â‚¬Å¡Ã‚Â¬Ãƒâ€¦Ã‚Â¡ÃƒÆ’Ã¢â‚¬Å¡Ãƒâ€šÃ‚Â¬ÃƒÆ’Ã†â€™Ãƒâ€šÃ‚Â¢ÃƒÆ’Ã‚Â¢ÃƒÂ¢Ã¢â‚¬Å¡Ã‚Â¬Ãƒâ€¦Ã‚Â¾ÃƒÆ’Ã¢â‚¬Å¡Ãƒâ€šÃ‚Â¢ÃƒÆ’Ã†â€™Ãƒâ€ Ã¢â‚¬â„¢ÃƒÆ’Ã¢â‚¬Â ÃƒÂ¢Ã¢â€šÂ¬Ã¢â€žÂ¢ÃƒÆ’Ã†â€™ÃƒÂ¢Ã¢â€šÂ¬Ã‚Â ÃƒÆ’Ã‚Â¢ÃƒÂ¢Ã¢â‚¬Å¡Ã‚Â¬ÃƒÂ¢Ã¢â‚¬Å¾Ã‚Â¢ÃƒÆ’Ã†â€™Ãƒâ€ Ã¢â‚¬â„¢ÃƒÆ’Ã¢â‚¬Å¡Ãƒâ€šÃ‚Â¢ÃƒÆ’Ã†â€™Ãƒâ€šÃ‚Â¢ÃƒÆ’Ã‚Â¢ÃƒÂ¢Ã¢â‚¬Å¡Ã‚Â¬Ãƒâ€¦Ã‚Â¡ÃƒÆ’Ã¢â‚¬Å¡Ãƒâ€šÃ‚Â¬ÃƒÆ’Ã†â€™ÃƒÂ¢Ã¢â€šÂ¬Ã‚Â¦ÃƒÆ’Ã¢â‚¬Å¡Ãƒâ€šÃ‚Â¡ÃƒÆ’Ã†â€™Ãƒâ€ Ã¢â‚¬â„¢ÃƒÆ’Ã¢â‚¬Â ÃƒÂ¢Ã¢â€šÂ¬Ã¢â€žÂ¢ÃƒÆ’Ã†â€™Ãƒâ€šÃ‚Â¢ÃƒÆ’Ã‚Â¢ÃƒÂ¢Ã¢â€šÂ¬Ã…Â¡Ãƒâ€šÃ‚Â¬ÃƒÆ’Ã¢â‚¬Â¦Ãƒâ€šÃ‚Â¡ÃƒÆ’Ã†â€™Ãƒâ€ Ã¢â‚¬â„¢ÃƒÆ’Ã‚Â¢ÃƒÂ¢Ã¢â‚¬Å¡Ã‚Â¬Ãƒâ€¦Ã‚Â¡ÃƒÆ’Ã†â€™ÃƒÂ¢Ã¢â€šÂ¬Ã…Â¡ÃƒÆ’Ã¢â‚¬Å¡Ãƒâ€šÃ‚Â¢ÃƒÆ’Ã†â€™Ãƒâ€ Ã¢â‚¬â„¢ÃƒÆ’Ã¢â‚¬Â ÃƒÂ¢Ã¢â€šÂ¬Ã¢â€žÂ¢ÃƒÆ’Ã†â€™ÃƒÂ¢Ã¢â€šÂ¬Ã‚Â ÃƒÆ’Ã‚Â¢ÃƒÂ¢Ã¢â‚¬Å¡Ã‚Â¬ÃƒÂ¢Ã¢â‚¬Å¾Ã‚Â¢ÃƒÆ’Ã†â€™Ãƒâ€ Ã¢â‚¬â„¢ÃƒÆ’Ã‚Â¢ÃƒÂ¢Ã¢â‚¬Å¡Ã‚Â¬Ãƒâ€šÃ‚Â ÃƒÆ’Ã†â€™Ãƒâ€šÃ‚Â¢ÃƒÆ’Ã‚Â¢ÃƒÂ¢Ã¢â€šÂ¬Ã…Â¡Ãƒâ€šÃ‚Â¬ÃƒÆ’Ã‚Â¢ÃƒÂ¢Ã¢â€šÂ¬Ã…Â¾Ãƒâ€šÃ‚Â¢ÃƒÆ’Ã†â€™Ãƒâ€ Ã¢â‚¬â„¢ÃƒÆ’Ã¢â‚¬Â ÃƒÂ¢Ã¢â€šÂ¬Ã¢â€žÂ¢ÃƒÆ’Ã†â€™Ãƒâ€šÃ‚Â¢ÃƒÆ’Ã‚Â¢ÃƒÂ¢Ã¢â€šÂ¬Ã…Â¡Ãƒâ€šÃ‚Â¬ÃƒÆ’Ã¢â‚¬Â¦Ãƒâ€šÃ‚Â¡ÃƒÆ’Ã†â€™Ãƒâ€ Ã¢â‚¬â„¢ÃƒÆ’Ã‚Â¢ÃƒÂ¢Ã¢â‚¬Å¡Ã‚Â¬Ãƒâ€¦Ã‚Â¡ÃƒÆ’Ã†â€™ÃƒÂ¢Ã¢â€šÂ¬Ã…Â¡ÃƒÆ’Ã¢â‚¬Å¡Ãƒâ€šÃ‚Â¢ÃƒÆ’Ã†â€™Ãƒâ€ Ã¢â‚¬â„¢ÃƒÆ’Ã¢â‚¬Â ÃƒÂ¢Ã¢â€šÂ¬Ã¢â€žÂ¢ÃƒÆ’Ã†â€™ÃƒÂ¢Ã¢â€šÂ¬Ã‚Â ÃƒÆ’Ã‚Â¢ÃƒÂ¢Ã¢â‚¬Å¡Ã‚Â¬ÃƒÂ¢Ã¢â‚¬Å¾Ã‚Â¢ÃƒÆ’Ã†â€™Ãƒâ€ Ã¢â‚¬â„¢ÃƒÆ’Ã‚Â¢ÃƒÂ¢Ã¢â‚¬Å¡Ã‚Â¬Ãƒâ€¦Ã‚Â¡ÃƒÆ’Ã†â€™ÃƒÂ¢Ã¢â€šÂ¬Ã…Â¡ÃƒÆ’Ã¢â‚¬Å¡Ãƒâ€šÃ‚Â¢ÃƒÆ’Ã†â€™Ãƒâ€ Ã¢â‚¬â„¢ÃƒÆ’Ã¢â‚¬Â ÃƒÂ¢Ã¢â€šÂ¬Ã¢â€žÂ¢ÃƒÆ’Ã†â€™ÃƒÂ¢Ã¢â€šÂ¬Ã…Â¡ÃƒÆ’Ã¢â‚¬Å¡Ãƒâ€šÃ‚Â¢ÃƒÆ’Ã†â€™Ãƒâ€ Ã¢â‚¬â„¢ÃƒÆ’Ã¢â‚¬Å¡Ãƒâ€šÃ‚Â¢ÃƒÆ’Ã†â€™Ãƒâ€šÃ‚Â¢ÃƒÆ’Ã‚Â¢ÃƒÂ¢Ã¢â‚¬Å¡Ã‚Â¬Ãƒâ€¦Ã‚Â¡ÃƒÆ’Ã¢â‚¬Å¡Ãƒâ€šÃ‚Â¬ÃƒÆ’Ã†â€™ÃƒÂ¢Ã¢â€šÂ¬Ã‚Â¦ÃƒÆ’Ã¢â‚¬Å¡Ãƒâ€šÃ‚Â¡ÃƒÆ’Ã†â€™Ãƒâ€ Ã¢â‚¬â„¢ÃƒÆ’Ã‚Â¢ÃƒÂ¢Ã¢â‚¬Å¡Ã‚Â¬Ãƒâ€¦Ã‚Â¡ÃƒÆ’Ã†â€™ÃƒÂ¢Ã¢â€šÂ¬Ã…Â¡ÃƒÆ’Ã¢â‚¬Å¡Ãƒâ€šÃ‚Â¬ÃƒÆ’Ã†â€™Ãƒâ€ Ã¢â‚¬â„¢ÃƒÆ’Ã¢â‚¬Â ÃƒÂ¢Ã¢â€šÂ¬Ã¢â€žÂ¢ÃƒÆ’Ã†â€™Ãƒâ€šÃ‚Â¢ÃƒÆ’Ã‚Â¢ÃƒÂ¢Ã¢â€šÂ¬Ã…Â¡Ãƒâ€šÃ‚Â¬ÃƒÆ’Ã¢â‚¬Å¡Ãƒâ€šÃ‚Â¦ÃƒÆ’Ã†â€™Ãƒâ€ Ã¢â‚¬â„¢ÃƒÆ’Ã‚Â¢ÃƒÂ¢Ã¢â‚¬Å¡Ã‚Â¬Ãƒâ€¦Ã‚Â¡ÃƒÆ’Ã†â€™ÃƒÂ¢Ã¢â€šÂ¬Ã…Â¡ÃƒÆ’Ã¢â‚¬Å¡Ãƒâ€šÃ‚Â¡ÃƒÆ’Ã†â€™Ãƒâ€ Ã¢â‚¬â„¢ÃƒÆ’Ã¢â‚¬Â ÃƒÂ¢Ã¢â€šÂ¬Ã¢â€žÂ¢ÃƒÆ’Ã†â€™ÃƒÂ¢Ã¢â€šÂ¬Ã‚Â ÃƒÆ’Ã‚Â¢ÃƒÂ¢Ã¢â‚¬Å¡Ã‚Â¬ÃƒÂ¢Ã¢â‚¬Å¾Ã‚Â¢ÃƒÆ’Ã†â€™Ãƒâ€ Ã¢â‚¬â„¢ÃƒÆ’Ã¢â‚¬Å¡Ãƒâ€šÃ‚Â¢ÃƒÆ’Ã†â€™Ãƒâ€šÃ‚Â¢ÃƒÆ’Ã‚Â¢ÃƒÂ¢Ã¢â‚¬Å¡Ã‚Â¬Ãƒâ€¦Ã‚Â¡ÃƒÆ’Ã¢â‚¬Å¡Ãƒâ€šÃ‚Â¬ÃƒÆ’Ã†â€™ÃƒÂ¢Ã¢â€šÂ¬Ã‚Â¦ÃƒÆ’Ã¢â‚¬Å¡Ãƒâ€šÃ‚Â¡ÃƒÆ’Ã†â€™Ãƒâ€ Ã¢â‚¬â„¢ÃƒÆ’Ã¢â‚¬Â ÃƒÂ¢Ã¢â€šÂ¬Ã¢â€žÂ¢ÃƒÆ’Ã†â€™Ãƒâ€šÃ‚Â¢ÃƒÆ’Ã‚Â¢ÃƒÂ¢Ã¢â€šÂ¬Ã…Â¡Ãƒâ€šÃ‚Â¬ÃƒÆ’Ã¢â‚¬Â¦Ãƒâ€šÃ‚Â¡ÃƒÆ’Ã†â€™Ãƒâ€ Ã¢â‚¬â„¢ÃƒÆ’Ã‚Â¢ÃƒÂ¢Ã¢â‚¬Å¡Ã‚Â¬Ãƒâ€¦Ã‚Â¡ÃƒÆ’Ã†â€™ÃƒÂ¢Ã¢â€šÂ¬Ã…Â¡ÃƒÆ’Ã¢â‚¬Å¡Ãƒâ€šÃ‚Â¬ÃƒÆ’Ã†â€™Ãƒâ€ Ã¢â‚¬â„¢ÃƒÆ’Ã¢â‚¬Â ÃƒÂ¢Ã¢â€šÂ¬Ã¢â€žÂ¢ÃƒÆ’Ã†â€™ÃƒÂ¢Ã¢â€šÂ¬Ã‚Â ÃƒÆ’Ã‚Â¢ÃƒÂ¢Ã¢â‚¬Å¡Ã‚Â¬ÃƒÂ¢Ã¢â‚¬Å¾Ã‚Â¢ÃƒÆ’Ã†â€™Ãƒâ€ Ã¢â‚¬â„¢ÃƒÆ’Ã‚Â¢ÃƒÂ¢Ã¢â‚¬Å¡Ã‚Â¬Ãƒâ€šÃ‚Â ÃƒÆ’Ã†â€™Ãƒâ€šÃ‚Â¢ÃƒÆ’Ã‚Â¢ÃƒÂ¢Ã¢â€šÂ¬Ã…Â¡Ãƒâ€šÃ‚Â¬ÃƒÆ’Ã‚Â¢ÃƒÂ¢Ã¢â€šÂ¬Ã…Â¾Ãƒâ€šÃ‚Â¢ÃƒÆ’Ã†â€™Ãƒâ€ Ã¢â‚¬â„¢ÃƒÆ’Ã¢â‚¬Â ÃƒÂ¢Ã¢â€šÂ¬Ã¢â€žÂ¢ÃƒÆ’Ã†â€™ÃƒÂ¢Ã¢â€šÂ¬Ã…Â¡ÃƒÆ’Ã¢â‚¬Å¡Ãƒâ€šÃ‚Â¢ÃƒÆ’Ã†â€™Ãƒâ€ Ã¢â‚¬â„¢ÃƒÆ’Ã¢â‚¬Å¡Ãƒâ€šÃ‚Â¢ÃƒÆ’Ã†â€™Ãƒâ€šÃ‚Â¢ÃƒÆ’Ã‚Â¢ÃƒÂ¢Ã¢â€šÂ¬Ã…Â¡Ãƒâ€šÃ‚Â¬ÃƒÆ’Ã¢â‚¬Â¦Ãƒâ€šÃ‚Â¡ÃƒÆ’Ã†â€™ÃƒÂ¢Ã¢â€šÂ¬Ã…Â¡ÃƒÆ’Ã¢â‚¬Å¡Ãƒâ€šÃ‚Â¬ÃƒÆ’Ã†â€™Ãƒâ€ Ã¢â‚¬â„¢ÃƒÆ’Ã‚Â¢ÃƒÂ¢Ã¢â‚¬Å¡Ã‚Â¬Ãƒâ€¦Ã‚Â¡ÃƒÆ’Ã†â€™ÃƒÂ¢Ã¢â€šÂ¬Ã…Â¡ÃƒÆ’Ã¢â‚¬Å¡Ãƒâ€šÃ‚Â¦ÃƒÆ’Ã†â€™Ãƒâ€ Ã¢â‚¬â„¢ÃƒÆ’Ã¢â‚¬Â ÃƒÂ¢Ã¢â€šÂ¬Ã¢â€žÂ¢ÃƒÆ’Ã†â€™ÃƒÂ¢Ã¢â€šÂ¬Ã‚Â ÃƒÆ’Ã‚Â¢ÃƒÂ¢Ã¢â‚¬Å¡Ã‚Â¬ÃƒÂ¢Ã¢â‚¬Å¾Ã‚Â¢ÃƒÆ’Ã†â€™Ãƒâ€ Ã¢â‚¬â„¢ÃƒÆ’Ã‚Â¢ÃƒÂ¢Ã¢â‚¬Å¡Ã‚Â¬Ãƒâ€¦Ã‚Â¡ÃƒÆ’Ã†â€™ÃƒÂ¢Ã¢â€šÂ¬Ã…Â¡ÃƒÆ’Ã¢â‚¬Å¡Ãƒâ€šÃ‚Â¢ÃƒÆ’Ã†â€™Ãƒâ€ Ã¢â‚¬â„¢ÃƒÆ’Ã¢â‚¬Â ÃƒÂ¢Ã¢â€šÂ¬Ã¢â€žÂ¢ÃƒÆ’Ã†â€™ÃƒÂ¢Ã¢â€šÂ¬Ã…Â¡ÃƒÆ’Ã¢â‚¬Å¡Ãƒâ€šÃ‚Â¢ÃƒÆ’Ã†â€™Ãƒâ€ Ã¢â‚¬â„¢ÃƒÆ’Ã¢â‚¬Å¡Ãƒâ€šÃ‚Â¢ÃƒÆ’Ã†â€™Ãƒâ€šÃ‚Â¢ÃƒÆ’Ã‚Â¢ÃƒÂ¢Ã¢â‚¬Å¡Ã‚Â¬Ãƒâ€¦Ã‚Â¡ÃƒÆ’Ã¢â‚¬Å¡Ãƒâ€šÃ‚Â¬ÃƒÆ’Ã†â€™ÃƒÂ¢Ã¢â€šÂ¬Ã‚Â¦ÃƒÆ’Ã¢â‚¬Å¡Ãƒâ€šÃ‚Â¡ÃƒÆ’Ã†â€™Ãƒâ€ Ã¢â‚¬â„¢ÃƒÆ’Ã‚Â¢ÃƒÂ¢Ã¢â‚¬Å¡Ã‚Â¬Ãƒâ€¦Ã‚Â¡ÃƒÆ’Ã†â€™ÃƒÂ¢Ã¢â€šÂ¬Ã…Â¡ÃƒÆ’Ã¢â‚¬Å¡Ãƒâ€šÃ‚Â¬ÃƒÆ’Ã†â€™Ãƒâ€ Ã¢â‚¬â„¢ÃƒÆ’Ã¢â‚¬Â ÃƒÂ¢Ã¢â€šÂ¬Ã¢â€žÂ¢ÃƒÆ’Ã†â€™Ãƒâ€šÃ‚Â¢ÃƒÆ’Ã‚Â¢ÃƒÂ¢Ã¢â€šÂ¬Ã…Â¡Ãƒâ€šÃ‚Â¬ÃƒÆ’Ã¢â‚¬Å¡Ãƒâ€šÃ‚Â¦ÃƒÆ’Ã†â€™Ãƒâ€ Ã¢â‚¬â„¢ÃƒÆ’Ã¢â‚¬Å¡Ãƒâ€šÃ‚Â¢ÃƒÆ’Ã†â€™Ãƒâ€šÃ‚Â¢ÃƒÆ’Ã‚Â¢ÃƒÂ¢Ã¢â‚¬Å¡Ã‚Â¬Ãƒâ€¦Ã‚Â¡ÃƒÆ’Ã¢â‚¬Å¡Ãƒâ€šÃ‚Â¬ÃƒÆ’Ã†â€™ÃƒÂ¢Ã¢â€šÂ¬Ã‚Â¦ÃƒÆ’Ã‚Â¢ÃƒÂ¢Ã¢â‚¬Å¡Ã‚Â¬Ãƒâ€¦Ã¢â‚¬Å“Wk4), both systems experienced strong positive growth, with Monoculture slightly higher (10.370 g/day) than IMTA (9.087 g/day).</w:t>
+      </w:r>
+    </w:p>
+    <w:p>
+      <w:pPr>
+        <w:spacing w:line="360" w:lineRule="auto"/>
+        <w:rPr>
+          <w:rFonts w:ascii="Times New Roman" w:hAnsi="Times New Roman" w:cs="Times New Roman"/>
+        </w:rPr>
+      </w:pPr>
+      <w:r>
+        <w:rPr>
+          <w:rFonts w:ascii="Times New Roman" w:hAnsi="Times New Roman" w:cs="Times New Roman"/>
+        </w:rPr>
+        <w:t xml:space="preserve">A major divergence occurred in the Wk4ÃƒÆ’Ã†â€™Ãƒâ€ Ã¢â‚¬â„¢ÃƒÆ’Ã¢â‚¬Â ÃƒÂ¢Ã¢â€šÂ¬Ã¢â€žÂ¢ÃƒÆ’Ã†â€™ÃƒÂ¢Ã¢â€šÂ¬Ã‚Â ÃƒÆ’Ã‚Â¢ÃƒÂ¢Ã¢â‚¬Å¡Ã‚Â¬ÃƒÂ¢Ã¢â‚¬Å¾Ã‚Â¢ÃƒÆ’Ã†â€™Ãƒâ€ Ã¢â‚¬â„¢ÃƒÆ’Ã‚Â¢ÃƒÂ¢Ã¢â‚¬Å¡Ã‚Â¬Ãƒâ€šÃ‚Â ÃƒÆ’Ã†â€™Ãƒâ€šÃ‚Â¢ÃƒÆ’Ã‚Â¢ÃƒÂ¢Ã¢â€šÂ¬Ã…Â¡Ãƒâ€šÃ‚Â¬ÃƒÆ’Ã‚Â¢ÃƒÂ¢Ã¢â€šÂ¬Ã…Â¾Ãƒâ€šÃ‚Â¢ÃƒÆ’Ã†â€™Ãƒâ€ Ã¢â‚¬â„¢ÃƒÆ’Ã¢â‚¬Â ÃƒÂ¢Ã¢â€šÂ¬Ã¢â€žÂ¢ÃƒÆ’Ã†â€™Ãƒâ€šÃ‚Â¢ÃƒÆ’Ã‚Â¢ÃƒÂ¢Ã¢â€šÂ¬Ã…Â¡Ãƒâ€šÃ‚Â¬ÃƒÆ’Ã¢â‚¬Å¡Ãƒâ€šÃ‚Â ÃƒÆ’Ã†â€™Ãƒâ€ Ã¢â‚¬â„¢ÃƒÆ’Ã¢â‚¬Å¡Ãƒâ€šÃ‚Â¢ÃƒÆ’Ã†â€™Ãƒâ€šÃ‚Â¢ÃƒÆ’Ã‚Â¢ÃƒÂ¢Ã¢â‚¬Å¡Ã‚Â¬Ãƒâ€¦Ã‚Â¡ÃƒÆ’Ã¢â‚¬Å¡Ãƒâ€šÃ‚Â¬ÃƒÆ’Ã†â€™Ãƒâ€šÃ‚Â¢ÃƒÆ’Ã‚Â¢ÃƒÂ¢Ã¢â‚¬Å¡Ã‚Â¬Ãƒâ€¦Ã‚Â¾ÃƒÆ’Ã¢â‚¬Å¡Ãƒâ€šÃ‚Â¢ÃƒÆ’Ã†â€™Ãƒâ€ Ã¢â‚¬â„¢ÃƒÆ’Ã¢â‚¬Â ÃƒÂ¢Ã¢â€šÂ¬Ã¢â€žÂ¢ÃƒÆ’Ã†â€™ÃƒÂ¢Ã¢â€šÂ¬Ã‚Â ÃƒÆ’Ã‚Â¢ÃƒÂ¢Ã¢â‚¬Å¡Ã‚Â¬ÃƒÂ¢Ã¢â‚¬Å¾Ã‚Â¢ÃƒÆ’Ã†â€™Ãƒâ€ Ã¢â‚¬â„¢ÃƒÆ’Ã¢â‚¬Å¡Ãƒâ€šÃ‚Â¢ÃƒÆ’Ã†â€™Ãƒâ€šÃ‚Â¢ÃƒÆ’Ã‚Â¢ÃƒÂ¢Ã¢â‚¬Å¡Ã‚Â¬Ãƒâ€¦Ã‚Â¡ÃƒÆ’Ã¢â‚¬Å¡Ãƒâ€šÃ‚Â¬ÃƒÆ’Ã†â€™ÃƒÂ¢Ã¢â€šÂ¬Ã…Â¡ÃƒÆ’Ã¢â‚¬Å¡Ãƒâ€šÃ‚Â ÃƒÆ’Ã†â€™Ãƒâ€ Ã¢â‚¬â„¢ÃƒÆ’Ã¢â‚¬Â ÃƒÂ¢Ã¢â€šÂ¬Ã¢â€žÂ¢ÃƒÆ’Ã†â€™ÃƒÂ¢Ã¢â€šÂ¬Ã…Â¡ÃƒÆ’Ã¢â‚¬Å¡Ãƒâ€šÃ‚Â¢ÃƒÆ’Ã†â€™Ãƒâ€ Ã¢â‚¬â„¢ÃƒÆ’Ã¢â‚¬Å¡Ãƒâ€šÃ‚Â¢ÃƒÆ’Ã†â€™Ãƒâ€šÃ‚Â¢ÃƒÆ’Ã‚Â¢ÃƒÂ¢Ã¢â€šÂ¬Ã…Â¡Ãƒâ€šÃ‚Â¬ÃƒÆ’Ã¢â‚¬Â¦Ãƒâ€šÃ‚Â¡ÃƒÆ’Ã†â€™ÃƒÂ¢Ã¢â€šÂ¬Ã…Â¡ÃƒÆ’Ã¢â‚¬Å¡Ãƒâ€šÃ‚Â¬ÃƒÆ’Ã†â€™Ãƒâ€ Ã¢â‚¬â„¢ÃƒÆ’Ã¢â‚¬Å¡Ãƒâ€šÃ‚Â¢ÃƒÆ’Ã†â€™Ãƒâ€šÃ‚Â¢ÃƒÆ’Ã‚Â¢ÃƒÂ¢Ã¢â€šÂ¬Ã…Â¡Ãƒâ€šÃ‚Â¬ÃƒÆ’Ã¢â‚¬Â¦Ãƒâ€šÃ‚Â¾ÃƒÆ’Ã†â€™ÃƒÂ¢Ã¢â€šÂ¬Ã…Â¡ÃƒÆ’Ã¢â‚¬Å¡Ãƒâ€šÃ‚Â¢ÃƒÆ’Ã†â€™Ãƒâ€ Ã¢â‚¬â„¢ÃƒÆ’Ã¢â‚¬Â ÃƒÂ¢Ã¢â€šÂ¬Ã¢â€žÂ¢ÃƒÆ’Ã†â€™ÃƒÂ¢Ã¢â€šÂ¬Ã‚Â ÃƒÆ’Ã‚Â¢ÃƒÂ¢Ã¢â‚¬Å¡Ã‚Â¬ÃƒÂ¢Ã¢â‚¬Å¾Ã‚Â¢ÃƒÆ’Ã†â€™Ãƒâ€ Ã¢â‚¬â„¢ÃƒÆ’Ã‚Â¢ÃƒÂ¢Ã¢â‚¬Å¡Ã‚Â¬Ãƒâ€šÃ‚Â ÃƒÆ’Ã†â€™Ãƒâ€šÃ‚Â¢ÃƒÆ’Ã‚Â¢ÃƒÂ¢Ã¢â€šÂ¬Ã…Â¡Ãƒâ€šÃ‚Â¬ÃƒÆ’Ã‚Â¢ÃƒÂ¢Ã¢â€šÂ¬Ã…Â¾Ãƒâ€šÃ‚Â¢ÃƒÆ’Ã†â€™Ãƒâ€ Ã¢â‚¬â„¢ÃƒÆ’Ã¢â‚¬Â ÃƒÂ¢Ã¢â€šÂ¬Ã¢â€žÂ¢ÃƒÆ’Ã†â€™ÃƒÂ¢Ã¢â€šÂ¬Ã…Â¡ÃƒÆ’Ã¢â‚¬Å¡Ãƒâ€šÃ‚Â¢ÃƒÆ’Ã†â€™Ãƒâ€ Ã¢â‚¬â„¢ÃƒÆ’Ã¢â‚¬Å¡Ãƒâ€šÃ‚Â¢ÃƒÆ’Ã†â€™Ãƒâ€šÃ‚Â¢ÃƒÆ’Ã‚Â¢ÃƒÂ¢Ã¢â€šÂ¬Ã…Â¡Ãƒâ€šÃ‚Â¬ÃƒÆ’Ã¢â‚¬Â¦Ãƒâ€šÃ‚Â¡ÃƒÆ’Ã†â€™ÃƒÂ¢Ã¢â€šÂ¬Ã…Â¡ÃƒÆ’Ã¢â‚¬Å¡Ãƒâ€šÃ‚Â¬ÃƒÆ’Ã†â€™Ãƒâ€ Ã¢â‚¬â„¢ÃƒÆ’Ã‚Â¢ÃƒÂ¢Ã¢â‚¬Å¡Ã‚Â¬Ãƒâ€šÃ‚Â¦ÃƒÆ’Ã†â€™ÃƒÂ¢Ã¢â€šÂ¬Ã…Â¡ÃƒÆ’Ã¢â‚¬Å¡Ãƒâ€šÃ‚Â¡ÃƒÆ’Ã†â€™Ãƒâ€ Ã¢â‚¬â„¢ÃƒÆ’Ã¢â‚¬Â ÃƒÂ¢Ã¢â€šÂ¬Ã¢â€žÂ¢ÃƒÆ’Ã†â€™ÃƒÂ¢Ã¢â€šÂ¬Ã‚Â ÃƒÆ’Ã‚Â¢ÃƒÂ¢Ã¢â‚¬Å¡Ã‚Â¬ÃƒÂ¢Ã¢â‚¬Å¾Ã‚Â¢ÃƒÆ’Ã†â€™Ãƒâ€ Ã¢â‚¬â„¢ÃƒÆ’Ã¢â‚¬Å¡Ãƒâ€šÃ‚Â¢ÃƒÆ’Ã†â€™Ãƒâ€šÃ‚Â¢ÃƒÆ’Ã‚Â¢ÃƒÂ¢Ã¢â‚¬Å¡Ã‚Â¬Ãƒâ€¦Ã‚Â¡ÃƒÆ’Ã¢â‚¬Å¡Ãƒâ€šÃ‚Â¬ÃƒÆ’Ã†â€™ÃƒÂ¢Ã¢â€šÂ¬Ã‚Â¦ÃƒÆ’Ã¢â‚¬Å¡Ãƒâ€šÃ‚Â¡ÃƒÆ’Ã†â€™Ãƒâ€ Ã¢â‚¬â„¢ÃƒÆ’Ã¢â‚¬Â ÃƒÂ¢Ã¢â€šÂ¬Ã¢â€žÂ¢ÃƒÆ’Ã†â€™Ãƒâ€šÃ‚Â¢ÃƒÆ’Ã‚Â¢ÃƒÂ¢Ã¢â€šÂ¬Ã…Â¡Ãƒâ€šÃ‚Â¬ÃƒÆ’Ã¢â‚¬Â¦Ãƒâ€šÃ‚Â¡ÃƒÆ’Ã†â€™Ãƒâ€ Ã¢â‚¬â„¢ÃƒÆ’Ã‚Â¢ÃƒÂ¢Ã¢â‚¬Å¡Ã‚Â¬Ãƒâ€¦Ã‚Â¡ÃƒÆ’Ã†â€™ÃƒÂ¢Ã¢â€šÂ¬Ã…Â¡ÃƒÆ’Ã¢â‚¬Å¡Ãƒâ€šÃ‚Â¢ÃƒÆ’Ã†â€™Ãƒâ€ Ã¢â‚¬â„¢ÃƒÆ’Ã¢â‚¬Â ÃƒÂ¢Ã¢â€šÂ¬Ã¢â€žÂ¢ÃƒÆ’Ã†â€™ÃƒÂ¢Ã¢â€šÂ¬Ã‚Â ÃƒÆ’Ã‚Â¢ÃƒÂ¢Ã¢â‚¬Å¡Ã‚Â¬ÃƒÂ¢Ã¢â‚¬Å¾Ã‚Â¢ÃƒÆ’Ã†â€™Ãƒâ€ Ã¢â‚¬â„¢ÃƒÆ’Ã‚Â¢ÃƒÂ¢Ã¢â‚¬Å¡Ã‚Â¬Ãƒâ€šÃ‚Â ÃƒÆ’Ã†â€™Ãƒâ€šÃ‚Â¢ÃƒÆ’Ã‚Â¢ÃƒÂ¢Ã¢â€šÂ¬Ã…Â¡Ãƒâ€šÃ‚Â¬ÃƒÆ’Ã‚Â¢ÃƒÂ¢Ã¢â€šÂ¬Ã…Â¾Ãƒâ€šÃ‚Â¢ÃƒÆ’Ã†â€™Ãƒâ€ Ã¢â‚¬â„¢ÃƒÆ’Ã¢â‚¬Â ÃƒÂ¢Ã¢â€šÂ¬Ã¢â€žÂ¢ÃƒÆ’Ã†â€™Ãƒâ€šÃ‚Â¢ÃƒÆ’Ã‚Â¢ÃƒÂ¢Ã¢â€šÂ¬Ã…Â¡Ãƒâ€šÃ‚Â¬ÃƒÆ’Ã¢â‚¬Å¡Ãƒâ€šÃ‚Â ÃƒÆ’Ã†â€™Ãƒâ€ Ã¢â‚¬â„¢ÃƒÆ’Ã¢â‚¬Å¡Ãƒâ€šÃ‚Â¢ÃƒÆ’Ã†â€™Ãƒâ€šÃ‚Â¢ÃƒÆ’Ã‚Â¢ÃƒÂ¢Ã¢â‚¬Å¡Ã‚Â¬Ãƒâ€¦Ã‚Â¡ÃƒÆ’Ã¢â‚¬Å¡Ãƒâ€šÃ‚Â¬ÃƒÆ’Ã†â€™Ãƒâ€šÃ‚Â¢ÃƒÆ’Ã‚Â¢ÃƒÂ¢Ã¢â‚¬Å¡Ã‚Â¬Ãƒâ€¦Ã‚Â¾ÃƒÆ’Ã¢â‚¬Å¡Ãƒâ€šÃ‚Â¢ÃƒÆ’Ã†â€™Ãƒâ€ Ã¢â‚¬â„¢ÃƒÆ’Ã¢â‚¬Â ÃƒÂ¢Ã¢â€šÂ¬Ã¢â€žÂ¢ÃƒÆ’Ã†â€™ÃƒÂ¢Ã¢â€šÂ¬Ã‚Â ÃƒÆ’Ã‚Â¢ÃƒÂ¢Ã¢â‚¬Å¡Ã‚Â¬ÃƒÂ¢Ã¢â‚¬Å¾Ã‚Â¢ÃƒÆ’Ã†â€™Ãƒâ€ Ã¢â‚¬â„¢ÃƒÆ’Ã¢â‚¬Å¡Ãƒâ€šÃ‚Â¢ÃƒÆ’Ã†â€™Ãƒâ€šÃ‚Â¢ÃƒÆ’Ã‚Â¢ÃƒÂ¢Ã¢â‚¬Å¡Ã‚Â¬Ãƒâ€¦Ã‚Â¡ÃƒÆ’Ã¢â‚¬Å¡Ãƒâ€šÃ‚Â¬ÃƒÆ’Ã†â€™ÃƒÂ¢Ã¢â€šÂ¬Ã‚Â¦ÃƒÆ’Ã¢â‚¬Å¡Ãƒâ€šÃ‚Â¡ÃƒÆ’Ã†â€™Ãƒâ€ Ã¢â‚¬â„¢ÃƒÆ’Ã¢â‚¬Â ÃƒÂ¢Ã¢â€šÂ¬Ã¢â€žÂ¢ÃƒÆ’Ã†â€™Ãƒâ€šÃ‚Â¢ÃƒÆ’Ã‚Â¢ÃƒÂ¢Ã¢â€šÂ¬Ã…Â¡Ãƒâ€šÃ‚Â¬ÃƒÆ’Ã¢â‚¬Â¦Ãƒâ€šÃ‚Â¡ÃƒÆ’Ã†â€™Ãƒâ€ Ã¢â‚¬â„¢ÃƒÆ’Ã‚Â¢ÃƒÂ¢Ã¢â‚¬Å¡Ã‚Â¬Ãƒâ€¦Ã‚Â¡ÃƒÆ’Ã†â€™ÃƒÂ¢Ã¢â€šÂ¬Ã…Â¡ÃƒÆ’Ã¢â‚¬Å¡Ãƒâ€šÃ‚Â¢ÃƒÆ’Ã†â€™Ãƒâ€ Ã¢â‚¬â„¢ÃƒÆ’Ã¢â‚¬Â ÃƒÂ¢Ã¢â€šÂ¬Ã¢â€žÂ¢ÃƒÆ’Ã†â€™ÃƒÂ¢Ã¢â€šÂ¬Ã‚Â ÃƒÆ’Ã‚Â¢ÃƒÂ¢Ã¢â‚¬Å¡Ã‚Â¬ÃƒÂ¢Ã¢â‚¬Å¾Ã‚Â¢ÃƒÆ’Ã†â€™Ãƒâ€ Ã¢â‚¬â„¢ÃƒÆ’Ã‚Â¢ÃƒÂ¢Ã¢â‚¬Å¡Ã‚Â¬Ãƒâ€šÃ‚Â ÃƒÆ’Ã†â€™Ãƒâ€šÃ‚Â¢ÃƒÆ’Ã‚Â¢ÃƒÂ¢Ã¢â€šÂ¬Ã…Â¡Ãƒâ€šÃ‚Â¬ÃƒÆ’Ã‚Â¢ÃƒÂ¢Ã¢â€šÂ¬Ã…Â¾Ãƒâ€šÃ‚Â¢ÃƒÆ’Ã†â€™Ãƒâ€ Ã¢â‚¬â„¢ÃƒÆ’Ã¢â‚¬Â ÃƒÂ¢Ã¢â€šÂ¬Ã¢â€žÂ¢ÃƒÆ’Ã†â€™Ãƒâ€šÃ‚Â¢ÃƒÆ’Ã‚Â¢ÃƒÂ¢Ã¢â€šÂ¬Ã…Â¡Ãƒâ€šÃ‚Â¬ÃƒÆ’Ã¢â‚¬Â¦Ãƒâ€šÃ‚Â¡ÃƒÆ’Ã†â€™Ãƒâ€ Ã¢â‚¬â„¢ÃƒÆ’Ã‚Â¢ÃƒÂ¢Ã¢â‚¬Å¡Ã‚Â¬Ãƒâ€¦Ã‚Â¡ÃƒÆ’Ã†â€™ÃƒÂ¢Ã¢â€šÂ¬Ã…Â¡ÃƒÆ’Ã¢â‚¬Å¡Ãƒâ€šÃ‚Â¢ÃƒÆ’Ã†â€™Ãƒâ€ Ã¢â‚¬â„¢ÃƒÆ’Ã¢â‚¬Â ÃƒÂ¢Ã¢â€šÂ¬Ã¢â€žÂ¢ÃƒÆ’Ã†â€™ÃƒÂ¢Ã¢â€šÂ¬Ã‚Â ÃƒÆ’Ã‚Â¢ÃƒÂ¢Ã¢â‚¬Å¡Ã‚Â¬ÃƒÂ¢Ã¢â‚¬Å¾Ã‚Â¢ÃƒÆ’Ã†â€™Ãƒâ€ Ã¢â‚¬â„¢ÃƒÆ’Ã‚Â¢ÃƒÂ¢Ã¢â‚¬Å¡Ã‚Â¬Ãƒâ€¦Ã‚Â¡ÃƒÆ’Ã†â€™ÃƒÂ¢Ã¢â€šÂ¬Ã…Â¡ÃƒÆ’Ã¢â‚¬Å¡Ãƒâ€šÃ‚Â¢ÃƒÆ’Ã†â€™Ãƒâ€ Ã¢â‚¬â„¢ÃƒÆ’Ã¢â‚¬Â ÃƒÂ¢Ã¢â€šÂ¬Ã¢â€žÂ¢ÃƒÆ’Ã†â€™ÃƒÂ¢Ã¢â€šÂ¬Ã…Â¡ÃƒÆ’Ã¢â‚¬Å¡Ãƒâ€šÃ‚Â¢ÃƒÆ’Ã†â€™Ãƒâ€ Ã¢â‚¬â„¢ÃƒÆ’Ã¢â‚¬Å¡Ãƒâ€šÃ‚Â¢ÃƒÆ’Ã†â€™Ãƒâ€šÃ‚Â¢ÃƒÆ’Ã‚Â¢ÃƒÂ¢Ã¢â€šÂ¬Ã…Â¡Ãƒâ€šÃ‚Â¬ÃƒÆ’Ã¢â‚¬Â¦Ãƒâ€šÃ‚Â¡ÃƒÆ’Ã†â€™ÃƒÂ¢Ã¢â€šÂ¬Ã…Â¡ÃƒÆ’Ã¢â‚¬Å¡Ãƒâ€šÃ‚Â¬ÃƒÆ’Ã†â€™Ãƒâ€ Ã¢â‚¬â„¢ÃƒÆ’Ã‚Â¢ÃƒÂ¢Ã¢â‚¬Å¡Ã‚Â¬Ãƒâ€šÃ‚Â¦ÃƒÆ’Ã†â€™ÃƒÂ¢Ã¢â€šÂ¬Ã…Â¡ÃƒÆ’Ã¢â‚¬Å¡Ãƒâ€šÃ‚Â¡ÃƒÆ’Ã†â€™Ãƒâ€ Ã¢â‚¬â„¢ÃƒÆ’Ã¢â‚¬Â ÃƒÂ¢Ã¢â€šÂ¬Ã¢â€žÂ¢ÃƒÆ’Ã†â€™Ãƒâ€šÃ‚Â¢ÃƒÆ’Ã‚Â¢ÃƒÂ¢Ã¢â€šÂ¬Ã…Â¡Ãƒâ€šÃ‚Â¬ÃƒÆ’Ã¢â‚¬Â¦Ãƒâ€šÃ‚Â¡ÃƒÆ’Ã†â€™Ãƒâ€ Ã¢â‚¬â„¢ÃƒÆ’Ã‚Â¢ÃƒÂ¢Ã¢â‚¬Å¡Ã‚Â¬Ãƒâ€¦Ã‚Â¡ÃƒÆ’Ã†â€™ÃƒÂ¢Ã¢â€šÂ¬Ã…Â¡ÃƒÆ’Ã¢â‚¬Å¡Ãƒâ€šÃ‚Â¬ÃƒÆ’Ã†â€™Ãƒâ€ Ã¢â‚¬â„¢ÃƒÆ’Ã¢â‚¬Â ÃƒÂ¢Ã¢â€šÂ¬Ã¢â€žÂ¢ÃƒÆ’Ã†â€™ÃƒÂ¢Ã¢â€šÂ¬Ã‚Â ÃƒÆ’Ã‚Â¢ÃƒÂ¢Ã¢â‚¬Å¡Ã‚Â¬ÃƒÂ¢Ã¢â‚¬Å¾Ã‚Â¢ÃƒÆ’Ã†â€™Ãƒâ€ Ã¢â‚¬â„¢ÃƒÆ’Ã¢â‚¬Å¡Ãƒâ€šÃ‚Â¢ÃƒÆ’Ã†â€™Ãƒâ€šÃ‚Â¢ÃƒÆ’Ã‚Â¢ÃƒÂ¢Ã¢â‚¬Å¡Ã‚Â¬Ãƒâ€¦Ã‚Â¡ÃƒÆ’Ã¢â‚¬Å¡Ãƒâ€šÃ‚Â¬ÃƒÆ’Ã†â€™ÃƒÂ¢Ã¢â€šÂ¬Ã…Â¡ÃƒÆ’Ã¢â‚¬Å¡Ãƒâ€šÃ‚Â¦ÃƒÆ’Ã†â€™Ãƒâ€ Ã¢â‚¬â„¢ÃƒÆ’Ã¢â‚¬Â ÃƒÂ¢Ã¢â€šÂ¬Ã¢â€žÂ¢ÃƒÆ’Ã†â€™Ãƒâ€šÃ‚Â¢ÃƒÆ’Ã‚Â¢ÃƒÂ¢Ã¢â€šÂ¬Ã…Â¡Ãƒâ€šÃ‚Â¬ÃƒÆ’Ã¢â‚¬Â¦Ãƒâ€šÃ‚Â¡ÃƒÆ’Ã†â€™Ãƒâ€ Ã¢â‚¬â„¢ÃƒÆ’Ã‚Â¢ÃƒÂ¢Ã¢â‚¬Å¡Ã‚Â¬Ãƒâ€¦Ã‚Â¡ÃƒÆ’Ã†â€™ÃƒÂ¢Ã¢â€šÂ¬Ã…Â¡ÃƒÆ’Ã¢â‚¬Å¡Ãƒâ€šÃ‚Â¡ÃƒÆ’Ã†â€™Ãƒâ€ Ã¢â‚¬â„¢ÃƒÆ’Ã¢â‚¬Â ÃƒÂ¢Ã¢â€šÂ¬Ã¢â€žÂ¢ÃƒÆ’Ã†â€™ÃƒÂ¢Ã¢â€šÂ¬Ã‚Â ÃƒÆ’Ã‚Â¢ÃƒÂ¢Ã¢â‚¬Å¡Ã‚Â¬ÃƒÂ¢Ã¢â‚¬Å¾Ã‚Â¢ÃƒÆ’Ã†â€™Ãƒâ€ Ã¢â‚¬â„¢ÃƒÆ’Ã‚Â¢ÃƒÂ¢Ã¢â‚¬Å¡Ã‚Â¬Ãƒâ€šÃ‚Â ÃƒÆ’Ã†â€™Ãƒâ€šÃ‚Â¢ÃƒÆ’Ã‚Â¢ÃƒÂ¢Ã¢â€šÂ¬Ã…Â¡Ãƒâ€šÃ‚Â¬ÃƒÆ’Ã‚Â¢ÃƒÂ¢Ã¢â€šÂ¬Ã…Â¾Ãƒâ€šÃ‚Â¢ÃƒÆ’Ã†â€™Ãƒâ€ Ã¢â‚¬â„¢ÃƒÆ’Ã¢â‚¬Â ÃƒÂ¢Ã¢â€šÂ¬Ã¢â€žÂ¢ÃƒÆ’Ã†â€™ÃƒÂ¢Ã¢â€šÂ¬Ã…Â¡ÃƒÆ’Ã¢â‚¬Å¡Ãƒâ€šÃ‚Â¢ÃƒÆ’Ã†â€™Ãƒâ€ Ã¢â‚¬â„¢ÃƒÆ’Ã¢â‚¬Å¡Ãƒâ€šÃ‚Â¢ÃƒÆ’Ã†â€™Ãƒâ€šÃ‚Â¢ÃƒÆ’Ã‚Â¢ÃƒÂ¢Ã¢â€šÂ¬Ã…Â¡Ãƒâ€šÃ‚Â¬ÃƒÆ’Ã¢â‚¬Â¦Ãƒâ€šÃ‚Â¡ÃƒÆ’Ã†â€™ÃƒÂ¢Ã¢â€šÂ¬Ã…Â¡ÃƒÆ’Ã¢â‚¬Å¡Ãƒâ€šÃ‚Â¬ÃƒÆ’Ã†â€™Ãƒâ€ Ã¢â‚¬â„¢ÃƒÆ’Ã‚Â¢ÃƒÂ¢Ã¢â‚¬Å¡Ã‚Â¬Ãƒâ€šÃ‚Â¦ÃƒÆ’Ã†â€™ÃƒÂ¢Ã¢â€šÂ¬Ã…Â¡ÃƒÆ’Ã¢â‚¬Å¡Ãƒâ€šÃ‚Â¡ÃƒÆ’Ã†â€™Ãƒâ€ Ã¢â‚¬â„¢ÃƒÆ’Ã¢â‚¬Â ÃƒÂ¢Ã¢â€šÂ¬Ã¢â€žÂ¢ÃƒÆ’Ã†â€™ÃƒÂ¢Ã¢â€šÂ¬Ã‚Â ÃƒÆ’Ã‚Â¢ÃƒÂ¢Ã¢â‚¬Å¡Ã‚Â¬ÃƒÂ¢Ã¢â‚¬Å¾Ã‚Â¢ÃƒÆ’Ã†â€™Ãƒâ€ Ã¢â‚¬â„¢ÃƒÆ’Ã¢â‚¬Å¡Ãƒâ€šÃ‚Â¢ÃƒÆ’Ã†â€™Ãƒâ€šÃ‚Â¢ÃƒÆ’Ã‚Â¢ÃƒÂ¢Ã¢â‚¬Å¡Ã‚Â¬Ãƒâ€¦Ã‚Â¡ÃƒÆ’Ã¢â‚¬Å¡Ãƒâ€šÃ‚Â¬ÃƒÆ’Ã†â€™ÃƒÂ¢Ã¢â€šÂ¬Ã‚Â¦ÃƒÆ’Ã¢â‚¬Å¡Ãƒâ€šÃ‚Â¡ÃƒÆ’Ã†â€™Ãƒâ€ Ã¢â‚¬â„¢ÃƒÆ’Ã¢â‚¬Â ÃƒÂ¢Ã¢â€šÂ¬Ã¢â€žÂ¢ÃƒÆ’Ã†â€™Ãƒâ€šÃ‚Â¢ÃƒÆ’Ã‚Â¢ÃƒÂ¢Ã¢â€šÂ¬Ã…Â¡Ãƒâ€šÃ‚Â¬ÃƒÆ’Ã¢â‚¬Â¦Ãƒâ€šÃ‚Â¡ÃƒÆ’Ã†â€™Ãƒâ€ Ã¢â‚¬â„¢ÃƒÆ’Ã‚Â¢ÃƒÂ¢Ã¢â‚¬Å¡Ã‚Â¬Ãƒâ€¦Ã‚Â¡ÃƒÆ’Ã†â€™ÃƒÂ¢Ã¢â€šÂ¬Ã…Â¡ÃƒÆ’Ã¢â‚¬Å¡Ãƒâ€šÃ‚Â¬ÃƒÆ’Ã†â€™Ãƒâ€ Ã¢â‚¬â„¢ÃƒÆ’Ã¢â‚¬Â ÃƒÂ¢Ã¢â€šÂ¬Ã¢â€žÂ¢ÃƒÆ’Ã†â€™ÃƒÂ¢Ã¢â€šÂ¬Ã‚Â ÃƒÆ’Ã‚Â¢ÃƒÂ¢Ã¢â‚¬Å¡Ã‚Â¬ÃƒÂ¢Ã¢â‚¬Å¾Ã‚Â¢ÃƒÆ’Ã†â€™Ãƒâ€ Ã¢â‚¬â„¢ÃƒÆ’Ã‚Â¢ÃƒÂ¢Ã¢â‚¬Å¡Ã‚Â¬Ãƒâ€šÃ‚Â ÃƒÆ’Ã†â€™Ãƒâ€šÃ‚Â¢ÃƒÆ’Ã‚Â¢ÃƒÂ¢Ã¢â€šÂ¬Ã…Â¡Ãƒâ€šÃ‚Â¬ÃƒÆ’Ã‚Â¢ÃƒÂ¢Ã¢â€šÂ¬Ã…Â¾Ãƒâ€šÃ‚Â¢ÃƒÆ’Ã†â€™Ãƒâ€ Ã¢â‚¬â„¢ÃƒÆ’Ã¢â‚¬Â ÃƒÂ¢Ã¢â€šÂ¬Ã¢â€žÂ¢ÃƒÆ’Ã†â€™Ãƒâ€šÃ‚Â¢ÃƒÆ’Ã‚Â¢ÃƒÂ¢Ã¢â€šÂ¬Ã…Â¡Ãƒâ€šÃ‚Â¬ÃƒÆ’Ã¢â‚¬Å¡Ãƒâ€šÃ‚Â ÃƒÆ’Ã†â€™Ãƒâ€ Ã¢â‚¬â„¢ÃƒÆ’Ã¢â‚¬Å¡Ãƒâ€šÃ‚Â¢ÃƒÆ’Ã†â€™Ãƒâ€šÃ‚Â¢ÃƒÆ’Ã‚Â¢ÃƒÂ¢Ã¢â‚¬Å¡Ã‚Â¬Ãƒâ€¦Ã‚Â¡ÃƒÆ’Ã¢â‚¬Å¡Ãƒâ€šÃ‚Â¬ÃƒÆ’Ã†â€™Ãƒâ€šÃ‚Â¢ÃƒÆ’Ã‚Â¢ÃƒÂ¢Ã¢â‚¬Å¡Ã‚Â¬Ãƒâ€¦Ã‚Â¾ÃƒÆ’Ã¢â‚¬Å¡Ãƒâ€šÃ‚Â¢ÃƒÆ’Ã†â€™Ãƒâ€ Ã¢â‚¬â„¢ÃƒÆ’Ã¢â‚¬Â ÃƒÂ¢Ã¢â€šÂ¬Ã¢â€žÂ¢ÃƒÆ’Ã†â€™ÃƒÂ¢Ã¢â€šÂ¬Ã‚Â ÃƒÆ’Ã‚Â¢ÃƒÂ¢Ã¢â‚¬Å¡Ã‚Â¬ÃƒÂ¢Ã¢â‚¬Å¾Ã‚Â¢ÃƒÆ’Ã†â€™Ãƒâ€ Ã¢â‚¬â„¢ÃƒÆ’Ã¢â‚¬Å¡Ãƒâ€šÃ‚Â¢ÃƒÆ’Ã†â€™Ãƒâ€šÃ‚Â¢ÃƒÆ’Ã‚Â¢ÃƒÂ¢Ã¢â‚¬Å¡Ã‚Â¬Ãƒâ€¦Ã‚Â¡ÃƒÆ’Ã¢â‚¬Å¡Ãƒâ€šÃ‚Â¬ÃƒÆ’Ã†â€™ÃƒÂ¢Ã¢â€šÂ¬Ã‚Â¦ÃƒÆ’Ã¢â‚¬Å¡Ãƒâ€šÃ‚Â¡ÃƒÆ’Ã†â€™Ãƒâ€ Ã¢â‚¬â„¢ÃƒÆ’Ã¢â‚¬Â ÃƒÂ¢Ã¢â€šÂ¬Ã¢â€žÂ¢ÃƒÆ’Ã†â€™Ãƒâ€šÃ‚Â¢ÃƒÆ’Ã‚Â¢ÃƒÂ¢Ã¢â€šÂ¬Ã…Â¡Ãƒâ€šÃ‚Â¬ÃƒÆ’Ã¢â‚¬Â¦Ãƒâ€šÃ‚Â¡ÃƒÆ’Ã†â€™Ãƒâ€ Ã¢â‚¬â„¢ÃƒÆ’Ã‚Â¢ÃƒÂ¢Ã¢â‚¬Å¡Ã‚Â¬Ãƒâ€¦Ã‚Â¡ÃƒÆ’Ã†â€™ÃƒÂ¢Ã¢â€šÂ¬Ã…Â¡ÃƒÆ’Ã¢â‚¬Å¡Ãƒâ€šÃ‚Â¢ÃƒÆ’Ã†â€™Ãƒâ€ Ã¢â‚¬â„¢ÃƒÆ’Ã¢â‚¬Â ÃƒÂ¢Ã¢â€šÂ¬Ã¢â€žÂ¢ÃƒÆ’Ã†â€™ÃƒÂ¢Ã¢â€šÂ¬Ã‚Â ÃƒÆ’Ã‚Â¢ÃƒÂ¢Ã¢â‚¬Å¡Ã‚Â¬ÃƒÂ¢Ã¢â‚¬Å¾Ã‚Â¢ÃƒÆ’Ã†â€™Ãƒâ€ Ã¢â‚¬â„¢ÃƒÆ’Ã‚Â¢ÃƒÂ¢Ã¢â‚¬Å¡Ã‚Â¬Ãƒâ€šÃ‚Â ÃƒÆ’Ã†â€™Ãƒâ€šÃ‚Â¢ÃƒÆ’Ã‚Â¢ÃƒÂ¢Ã¢â€šÂ¬Ã…Â¡Ãƒâ€šÃ‚Â¬ÃƒÆ’Ã‚Â¢ÃƒÂ¢Ã¢â€šÂ¬Ã…Â¾Ãƒâ€šÃ‚Â¢ÃƒÆ’Ã†â€™Ãƒâ€ Ã¢â‚¬â„¢ÃƒÆ’Ã¢â‚¬Â ÃƒÂ¢Ã¢â€šÂ¬Ã¢â€žÂ¢ÃƒÆ’Ã†â€™Ãƒâ€šÃ‚Â¢ÃƒÆ’Ã‚Â¢ÃƒÂ¢Ã¢â€šÂ¬Ã…Â¡Ãƒâ€šÃ‚Â¬ÃƒÆ’Ã¢â‚¬Â¦Ãƒâ€šÃ‚Â¡ÃƒÆ’Ã†â€™Ãƒâ€ Ã¢â‚¬â„¢ÃƒÆ’Ã‚Â¢ÃƒÂ¢Ã¢â‚¬Å¡Ã‚Â¬Ãƒâ€¦Ã‚Â¡ÃƒÆ’Ã†â€™ÃƒÂ¢Ã¢â€šÂ¬Ã…Â¡ÃƒÆ’Ã¢â‚¬Å¡Ãƒâ€šÃ‚Â¢ÃƒÆ’Ã†â€™Ãƒâ€ Ã¢â‚¬â„¢ÃƒÆ’Ã¢â‚¬Â ÃƒÂ¢Ã¢â€šÂ¬Ã¢â€žÂ¢ÃƒÆ’Ã†â€™ÃƒÂ¢Ã¢â€šÂ¬Ã‚Â ÃƒÆ’Ã‚Â¢ÃƒÂ¢Ã¢â‚¬Å¡Ã‚Â¬ÃƒÂ¢Ã¢â‚¬Å¾Ã‚Â¢ÃƒÆ’Ã†â€™Ãƒâ€ Ã¢â‚¬â„¢ÃƒÆ’Ã‚Â¢ÃƒÂ¢Ã¢â‚¬Å¡Ã‚Â¬Ãƒâ€¦Ã‚Â¡ÃƒÆ’Ã†â€™ÃƒÂ¢Ã¢â€šÂ¬Ã…Â¡ÃƒÆ’Ã¢â‚¬Å¡Ãƒâ€šÃ‚Â¢ÃƒÆ’Ã†â€™Ãƒâ€ Ã¢â‚¬â„¢ÃƒÆ’Ã¢â‚¬Â ÃƒÂ¢Ã¢â€šÂ¬Ã¢â€žÂ¢ÃƒÆ’Ã†â€™ÃƒÂ¢Ã¢â€šÂ¬Ã…Â¡ÃƒÆ’Ã¢â‚¬Å¡Ãƒâ€šÃ‚Â¢ÃƒÆ’Ã†â€™Ãƒâ€ Ã¢â‚¬â„¢ÃƒÆ’Ã¢â‚¬Å¡Ãƒâ€šÃ‚Â¢ÃƒÆ’Ã†â€™Ãƒâ€šÃ‚Â¢ÃƒÆ’Ã‚Â¢ÃƒÂ¢Ã¢â‚¬Å¡Ã‚Â¬Ãƒâ€¦Ã‚Â¡ÃƒÆ’Ã¢â‚¬Å¡Ãƒâ€šÃ‚Â¬ÃƒÆ’Ã†â€™ÃƒÂ¢Ã¢â€šÂ¬Ã‚Â¦ÃƒÆ’Ã¢â‚¬Å¡Ãƒâ€šÃ‚Â¡ÃƒÆ’Ã†â€™Ãƒâ€ Ã¢â‚¬â„¢ÃƒÆ’Ã‚Â¢ÃƒÂ¢Ã¢â‚¬Å¡Ã‚Â¬Ãƒâ€¦Ã‚Â¡ÃƒÆ’Ã†â€™ÃƒÂ¢Ã¢â€šÂ¬Ã…Â¡ÃƒÆ’Ã¢â‚¬Å¡Ãƒâ€šÃ‚Â¬ÃƒÆ’Ã†â€™Ãƒâ€ Ã¢â‚¬â„¢ÃƒÆ’Ã¢â‚¬Â ÃƒÂ¢Ã¢â€šÂ¬Ã¢â€žÂ¢ÃƒÆ’Ã†â€™Ãƒâ€šÃ‚Â¢ÃƒÆ’Ã‚Â¢ÃƒÂ¢Ã¢â€šÂ¬Ã…Â¡Ãƒâ€šÃ‚Â¬ÃƒÆ’Ã¢â‚¬Å¡Ãƒâ€šÃ‚Â¦ÃƒÆ’Ã†â€™Ãƒâ€ Ã¢â‚¬â„¢ÃƒÆ’Ã‚Â¢ÃƒÂ¢Ã¢â‚¬Å¡Ã‚Â¬Ãƒâ€¦Ã‚Â¡ÃƒÆ’Ã†â€™ÃƒÂ¢Ã¢â€šÂ¬Ã…Â¡ÃƒÆ’Ã¢â‚¬Å¡Ãƒâ€šÃ‚Â¡ÃƒÆ’Ã†â€™Ãƒâ€ Ã¢â‚¬â„¢ÃƒÆ’Ã¢â‚¬Â ÃƒÂ¢Ã¢â€šÂ¬Ã¢â€žÂ¢ÃƒÆ’Ã†â€™ÃƒÂ¢Ã¢â€šÂ¬Ã‚Â ÃƒÆ’Ã‚Â¢ÃƒÂ¢Ã¢â‚¬Å¡Ã‚Â¬ÃƒÂ¢Ã¢â‚¬Å¾Ã‚Â¢ÃƒÆ’Ã†â€™Ãƒâ€ Ã¢â‚¬â„¢ÃƒÆ’Ã¢â‚¬Å¡Ãƒâ€šÃ‚Â¢ÃƒÆ’Ã†â€™Ãƒâ€šÃ‚Â¢ÃƒÆ’Ã‚Â¢ÃƒÂ¢Ã¢â‚¬Å¡Ã‚Â¬Ãƒâ€¦Ã‚Â¡ÃƒÆ’Ã¢â‚¬Å¡Ãƒâ€šÃ‚Â¬ÃƒÆ’Ã†â€™ÃƒÂ¢Ã¢â€šÂ¬Ã‚Â¦ÃƒÆ’Ã¢â‚¬Å¡Ãƒâ€šÃ‚Â¡ÃƒÆ’Ã†â€™Ãƒâ€ Ã¢â‚¬â„¢ÃƒÆ’Ã¢â‚¬Â ÃƒÂ¢Ã¢â€šÂ¬Ã¢â€žÂ¢ÃƒÆ’Ã†â€™Ãƒâ€šÃ‚Â¢ÃƒÆ’Ã‚Â¢ÃƒÂ¢Ã¢â€šÂ¬Ã…Â¡Ãƒâ€šÃ‚Â¬ÃƒÆ’Ã¢â‚¬Â¦Ãƒâ€šÃ‚Â¡ÃƒÆ’Ã†â€™Ãƒâ€ Ã¢â‚¬â„¢ÃƒÆ’Ã‚Â¢ÃƒÂ¢Ã¢â‚¬Å¡Ã‚Â¬Ãƒâ€¦Ã‚Â¡ÃƒÆ’Ã†â€™ÃƒÂ¢Ã¢â€šÂ¬Ã…Â¡ÃƒÆ’Ã¢â‚¬Å¡Ãƒâ€šÃ‚Â¬ÃƒÆ’Ã†â€™Ãƒâ€ Ã¢â‚¬â„¢ÃƒÆ’Ã¢â‚¬Â ÃƒÂ¢Ã¢â€šÂ¬Ã¢â€žÂ¢ÃƒÆ’Ã†â€™ÃƒÂ¢Ã¢â€šÂ¬Ã‚Â ÃƒÆ’Ã‚Â¢ÃƒÂ¢Ã¢â‚¬Å¡Ã‚Â¬ÃƒÂ¢Ã¢â‚¬Å¾Ã‚Â¢ÃƒÆ’Ã†â€™Ãƒâ€ Ã¢â‚¬â„¢ÃƒÆ’Ã‚Â¢ÃƒÂ¢Ã¢â‚¬Å¡Ã‚Â¬Ãƒâ€šÃ‚Â ÃƒÆ’Ã†â€™Ãƒâ€šÃ‚Â¢ÃƒÆ’Ã‚Â¢ÃƒÂ¢Ã¢â€šÂ¬Ã…Â¡Ãƒâ€šÃ‚Â¬ÃƒÆ’Ã‚Â¢ÃƒÂ¢Ã¢â€šÂ¬Ã…Â¾Ãƒâ€šÃ‚Â¢ÃƒÆ’Ã†â€™Ãƒâ€ Ã¢â‚¬â„¢ÃƒÆ’Ã¢â‚¬Â ÃƒÂ¢Ã¢â€šÂ¬Ã¢â€žÂ¢ÃƒÆ’Ã†â€™ÃƒÂ¢Ã¢â€šÂ¬Ã…Â¡ÃƒÆ’Ã¢â‚¬Å¡Ãƒâ€šÃ‚Â¢ÃƒÆ’Ã†â€™Ãƒâ€ Ã¢â‚¬â„¢ÃƒÆ’Ã¢â‚¬Å¡Ãƒâ€šÃ‚Â¢ÃƒÆ’Ã†â€™Ãƒâ€šÃ‚Â¢ÃƒÆ’Ã‚Â¢ÃƒÂ¢Ã¢â€šÂ¬Ã…Â¡Ãƒâ€šÃ‚Â¬ÃƒÆ’Ã¢â‚¬Â¦Ãƒâ€šÃ‚Â¡ÃƒÆ’Ã†â€™ÃƒÂ¢Ã¢â€šÂ¬Ã…Â¡ÃƒÆ’Ã¢â‚¬Å¡Ãƒâ€šÃ‚Â¬ÃƒÆ’Ã†â€™Ãƒâ€ Ã¢â‚¬â„¢ÃƒÆ’Ã‚Â¢ÃƒÂ¢Ã¢â‚¬Å¡Ã‚Â¬Ãƒâ€¦Ã‚Â¡ÃƒÆ’Ã†â€™ÃƒÂ¢Ã¢â€šÂ¬Ã…Â¡ÃƒÆ’Ã¢â‚¬Å¡Ãƒâ€šÃ‚Â¦ÃƒÆ’Ã†â€™Ãƒâ€ Ã¢â‚¬â„¢ÃƒÆ’Ã¢â‚¬Â ÃƒÂ¢Ã¢â€šÂ¬Ã¢â€žÂ¢ÃƒÆ’Ã†â€™ÃƒÂ¢Ã¢â€šÂ¬Ã‚Â ÃƒÆ’Ã‚Â¢ÃƒÂ¢Ã¢â‚¬Å¡Ã‚Â¬ÃƒÂ¢Ã¢â‚¬Å¾Ã‚Â¢ÃƒÆ’Ã†â€™Ãƒâ€ Ã¢â‚¬â„¢ÃƒÆ’Ã‚Â¢ÃƒÂ¢Ã¢â‚¬Å¡Ã‚Â¬Ãƒâ€¦Ã‚Â¡ÃƒÆ’Ã†â€™ÃƒÂ¢Ã¢â€šÂ¬Ã…Â¡ÃƒÆ’Ã¢â‚¬Å¡Ãƒâ€šÃ‚Â¢ÃƒÆ’Ã†â€™Ãƒâ€ Ã¢â‚¬â„¢ÃƒÆ’Ã¢â‚¬Â ÃƒÂ¢Ã¢â€šÂ¬Ã¢â€žÂ¢ÃƒÆ’Ã†â€™ÃƒÂ¢Ã¢â€šÂ¬Ã…Â¡ÃƒÆ’Ã¢â‚¬Å¡Ãƒâ€šÃ‚Â¢ÃƒÆ’Ã†â€™Ãƒâ€ Ã¢â‚¬â„¢ÃƒÆ’Ã¢â‚¬Å¡Ãƒâ€šÃ‚Â¢ÃƒÆ’Ã†â€™Ãƒâ€šÃ‚Â¢ÃƒÆ’Ã‚Â¢ÃƒÂ¢Ã¢â‚¬Å¡Ã‚Â¬Ãƒâ€¦Ã‚Â¡ÃƒÆ’Ã¢â‚¬Å¡Ãƒâ€šÃ‚Â¬ÃƒÆ’Ã†â€™ÃƒÂ¢Ã¢â€šÂ¬Ã‚Â¦ÃƒÆ’Ã¢â‚¬Å¡Ãƒâ€šÃ‚Â¡ÃƒÆ’Ã†â€™Ãƒâ€ Ã¢â‚¬â„¢ÃƒÆ’Ã‚Â¢ÃƒÂ¢Ã¢â‚¬Å¡Ã‚Â¬Ãƒâ€¦Ã‚Â¡ÃƒÆ’Ã†â€™ÃƒÂ¢Ã¢â€šÂ¬Ã…Â¡ÃƒÆ’Ã¢â‚¬Å¡Ãƒâ€šÃ‚Â¬ÃƒÆ’Ã†â€™Ãƒâ€ Ã¢â‚¬â„¢ÃƒÆ’Ã¢â‚¬Â ÃƒÂ¢Ã¢â€šÂ¬Ã¢â€žÂ¢ÃƒÆ’Ã†â€™Ãƒâ€šÃ‚Â¢ÃƒÆ’Ã‚Â¢ÃƒÂ¢Ã¢â€šÂ¬Ã…Â¡Ãƒâ€šÃ‚Â¬ÃƒÆ’Ã¢â‚¬Å¡Ãƒâ€šÃ‚Â¦ÃƒÆ’Ã†â€™Ãƒâ€ Ã¢â‚¬â„¢ÃƒÆ’Ã¢â‚¬Å¡Ãƒâ€šÃ‚Â¢ÃƒÆ’Ã†â€™Ãƒâ€šÃ‚Â¢ÃƒÆ’Ã‚Â¢ÃƒÂ¢Ã¢â‚¬Å¡Ã‚Â¬Ãƒâ€¦Ã‚Â¡ÃƒÆ’Ã¢â‚¬Å¡Ãƒâ€šÃ‚Â¬ÃƒÆ’Ã†â€™ÃƒÂ¢Ã¢â€šÂ¬Ã‚Â¦ÃƒÆ’Ã‚Â¢ÃƒÂ¢Ã¢â‚¬Å¡Ã‚Â¬Ãƒâ€¦Ã¢â‚¬Å“Wk5 interval, where the Monoculture system showed a severe drop in growth (-27.608 g/day), while the IMTA system only recorded a minor decline (-2.266 g/day), indicating greater stability in the IMTA setup. In the final interval (Wk5ÃƒÆ’Ã†â€™Ãƒâ€ Ã¢â‚¬â„¢ÃƒÆ’Ã¢â‚¬Â ÃƒÂ¢Ã¢â€šÂ¬Ã¢â€žÂ¢ÃƒÆ’Ã†â€™ÃƒÂ¢Ã¢â€šÂ¬Ã‚Â ÃƒÆ’Ã‚Â¢ÃƒÂ¢Ã¢â‚¬Å¡Ã‚Â¬ÃƒÂ¢Ã¢â‚¬Å¾Ã‚Â¢ÃƒÆ’Ã†â€™Ãƒâ€ Ã¢â‚¬â„¢ÃƒÆ’Ã‚Â¢ÃƒÂ¢Ã¢â‚¬Å¡Ã‚Â¬Ãƒâ€šÃ‚Â ÃƒÆ’Ã†â€™Ãƒâ€šÃ‚Â¢ÃƒÆ’Ã‚Â¢ÃƒÂ¢Ã¢â€šÂ¬Ã…Â¡Ãƒâ€šÃ‚Â¬ÃƒÆ’Ã‚Â¢ÃƒÂ¢Ã¢â€šÂ¬Ã…Â¾Ãƒâ€šÃ‚Â¢ÃƒÆ’Ã†â€™Ãƒâ€ Ã¢â‚¬â„¢ÃƒÆ’Ã¢â‚¬Â ÃƒÂ¢Ã¢â€šÂ¬Ã¢â€žÂ¢ÃƒÆ’Ã†â€™Ãƒâ€šÃ‚Â¢ÃƒÆ’Ã‚Â¢ÃƒÂ¢Ã¢â€šÂ¬Ã…Â¡Ãƒâ€šÃ‚Â¬ÃƒÆ’Ã¢â‚¬Å¡Ãƒâ€šÃ‚Â ÃƒÆ’Ã†â€™Ãƒâ€ Ã¢â‚¬â„¢ÃƒÆ’Ã¢â‚¬Å¡Ãƒâ€šÃ‚Â¢ÃƒÆ’Ã†â€™Ãƒâ€šÃ‚Â¢ÃƒÆ’Ã‚Â¢ÃƒÂ¢Ã¢â‚¬Å¡Ã‚Â¬Ãƒâ€¦Ã‚Â¡ÃƒÆ’Ã¢â‚¬Å¡Ãƒâ€šÃ‚Â¬ÃƒÆ’Ã†â€™Ãƒâ€šÃ‚Â¢ÃƒÆ’Ã‚Â¢ÃƒÂ¢Ã¢â‚¬Å¡Ã‚Â¬Ãƒâ€¦Ã‚Â¾ÃƒÆ’Ã¢â‚¬Å¡Ãƒâ€šÃ‚Â¢ÃƒÆ’Ã†â€™Ãƒâ€ Ã¢â‚¬â„¢ÃƒÆ’Ã¢â‚¬Â ÃƒÂ¢Ã¢â€šÂ¬Ã¢â€žÂ¢ÃƒÆ’Ã†â€™ÃƒÂ¢Ã¢â€šÂ¬Ã‚Â ÃƒÆ’Ã‚Â¢ÃƒÂ¢Ã¢â‚¬Å¡Ã‚Â¬ÃƒÂ¢Ã¢â‚¬Å¾Ã‚Â¢ÃƒÆ’Ã†â€™Ãƒâ€ Ã¢â‚¬â„¢ÃƒÆ’Ã¢â‚¬Å¡Ãƒâ€šÃ‚Â¢ÃƒÆ’Ã†â€™Ãƒâ€šÃ‚Â¢ÃƒÆ’Ã‚Â¢ÃƒÂ¢Ã¢â‚¬Å¡Ã‚Â¬Ãƒâ€¦Ã‚Â¡ÃƒÆ’Ã¢â‚¬Å¡Ãƒâ€šÃ‚Â¬ÃƒÆ’Ã†â€™ÃƒÂ¢Ã¢â€šÂ¬Ã…Â¡ÃƒÆ’Ã¢â‚¬Å¡Ãƒâ€šÃ‚Â ÃƒÆ’Ã†â€™Ãƒâ€ Ã¢â‚¬â„¢ÃƒÆ’Ã¢â‚¬Â ÃƒÂ¢Ã¢â€šÂ¬Ã¢â€žÂ¢ÃƒÆ’Ã†â€™ÃƒÂ¢Ã¢â€šÂ¬Ã…Â¡ÃƒÆ’Ã¢â‚¬Å¡Ãƒâ€šÃ‚Â¢ÃƒÆ’Ã†â€™Ãƒâ€ Ã¢â‚¬â„¢ÃƒÆ’Ã¢â‚¬Å¡Ãƒâ€šÃ‚Â¢ÃƒÆ’Ã†â€™Ãƒâ€šÃ‚Â¢ÃƒÆ’Ã‚Â¢ÃƒÂ¢Ã¢â€šÂ¬Ã…Â¡Ãƒâ€šÃ‚Â¬ÃƒÆ’Ã¢â‚¬Â¦Ãƒâ€šÃ‚Â¡ÃƒÆ’Ã†â€™ÃƒÂ¢Ã¢â€šÂ¬Ã…Â¡ÃƒÆ’Ã¢â‚¬Å¡Ãƒâ€šÃ‚Â¬ÃƒÆ’Ã†â€™Ãƒâ€ Ã¢â‚¬â„¢ÃƒÆ’Ã¢â‚¬Å¡Ãƒâ€šÃ‚Â¢ÃƒÆ’Ã†â€™Ãƒâ€šÃ‚Â¢ÃƒÆ’Ã‚Â¢ÃƒÂ¢Ã¢â€šÂ¬Ã…Â¡Ãƒâ€šÃ‚Â¬ÃƒÆ’Ã¢â‚¬Â¦Ãƒâ€šÃ‚Â¾ÃƒÆ’Ã†â€™ÃƒÂ¢Ã¢â€šÂ¬Ã…Â¡ÃƒÆ’Ã¢â‚¬Å¡Ãƒâ€šÃ‚Â¢ÃƒÆ’Ã†â€™Ãƒâ€ Ã¢â‚¬â„¢ÃƒÆ’Ã¢â‚¬Â ÃƒÂ¢Ã¢â€šÂ¬Ã¢â€žÂ¢ÃƒÆ’Ã†â€™ÃƒÂ¢Ã¢â€šÂ¬Ã‚Â ÃƒÆ’Ã‚Â¢ÃƒÂ¢Ã¢â‚¬Å¡Ã‚Â¬ÃƒÂ¢Ã¢â‚¬Å¾Ã‚Â¢ÃƒÆ’Ã†â€™Ãƒâ€ Ã¢â‚¬â„¢ÃƒÆ’Ã‚Â¢ÃƒÂ¢Ã¢â‚¬Å¡Ã‚Â¬Ãƒâ€šÃ‚Â ÃƒÆ’Ã†â€™Ãƒâ€šÃ‚Â¢ÃƒÆ’Ã‚Â¢ÃƒÂ¢Ã¢â€šÂ¬Ã…Â¡Ãƒâ€šÃ‚Â¬ÃƒÆ’Ã‚Â¢ÃƒÂ¢Ã¢â€šÂ¬Ã…Â¾Ãƒâ€šÃ‚Â¢ÃƒÆ’Ã†â€™Ãƒâ€ Ã¢â‚¬â„¢ÃƒÆ’Ã¢â‚¬Â ÃƒÂ¢Ã¢â€šÂ¬Ã¢â€žÂ¢ÃƒÆ’Ã†â€™ÃƒÂ¢Ã¢â€šÂ¬Ã…Â¡ÃƒÆ’Ã¢â‚¬Å¡Ãƒâ€šÃ‚Â¢ÃƒÆ’Ã†â€™Ãƒâ€ Ã¢â‚¬â„¢ÃƒÆ’Ã¢â‚¬Å¡Ãƒâ€šÃ‚Â¢ÃƒÆ’Ã†â€™Ãƒâ€šÃ‚Â¢ÃƒÆ’Ã‚Â¢ÃƒÂ¢Ã¢â€šÂ¬Ã…Â¡Ãƒâ€šÃ‚Â¬ÃƒÆ’Ã¢â‚¬Â¦Ãƒâ€šÃ‚Â¡ÃƒÆ’Ã†â€™ÃƒÂ¢Ã¢â€šÂ¬Ã…Â¡ÃƒÆ’Ã¢â‚¬Å¡Ãƒâ€šÃ‚Â¬ÃƒÆ’Ã†â€™Ãƒâ€ Ã¢â‚¬â„¢ÃƒÆ’Ã‚Â¢ÃƒÂ¢Ã¢â‚¬Å¡Ã‚Â¬Ãƒâ€šÃ‚Â¦ÃƒÆ’Ã†â€™ÃƒÂ¢Ã¢â€šÂ¬Ã…Â¡ÃƒÆ’Ã¢â‚¬Å¡Ãƒâ€šÃ‚Â¡ÃƒÆ’Ã†â€™Ãƒâ€ Ã¢â‚¬â„¢ÃƒÆ’Ã¢â‚¬Â ÃƒÂ¢Ã¢â€šÂ¬Ã¢â€žÂ¢ÃƒÆ’Ã†â€™ÃƒÂ¢Ã¢â€šÂ¬Ã‚Â ÃƒÆ’Ã‚Â¢ÃƒÂ¢Ã¢â‚¬Å¡Ã‚Â¬ÃƒÂ¢Ã¢â‚¬Å¾Ã‚Â¢ÃƒÆ’Ã†â€™Ãƒâ€ Ã¢â‚¬â„¢ÃƒÆ’Ã¢â‚¬Å¡Ãƒâ€šÃ‚Â¢ÃƒÆ’Ã†â€™Ãƒâ€šÃ‚Â¢ÃƒÆ’Ã‚Â¢ÃƒÂ¢Ã¢â‚¬Å¡Ã‚Â¬Ãƒâ€¦Ã‚Â¡ÃƒÆ’Ã¢â‚¬Å¡Ãƒâ€šÃ‚Â¬ÃƒÆ’Ã†â€™ÃƒÂ¢Ã¢â€šÂ¬Ã‚Â¦ÃƒÆ’Ã¢â‚¬Å¡Ãƒâ€šÃ‚Â¡ÃƒÆ’Ã†â€™Ãƒâ€ Ã¢â‚¬â„¢ÃƒÆ’Ã¢â‚¬Â ÃƒÂ¢Ã¢â€šÂ¬Ã¢â€žÂ¢ÃƒÆ’Ã†â€™Ãƒâ€šÃ‚Â¢ÃƒÆ’Ã‚Â¢ÃƒÂ¢Ã¢â€šÂ¬Ã…Â¡Ãƒâ€šÃ‚Â¬ÃƒÆ’Ã¢â‚¬Â¦Ãƒâ€šÃ‚Â¡ÃƒÆ’Ã†â€™Ãƒâ€ Ã¢â‚¬â„¢ÃƒÆ’Ã‚Â¢ÃƒÂ¢Ã¢â‚¬Å¡Ã‚Â¬Ãƒâ€¦Ã‚Â¡ÃƒÆ’Ã†â€™ÃƒÂ¢Ã¢â€šÂ¬Ã…Â¡ÃƒÆ’Ã¢â‚¬Å¡Ãƒâ€šÃ‚Â¢ÃƒÆ’Ã†â€™Ãƒâ€ Ã¢â‚¬â„¢ÃƒÆ’Ã¢â‚¬Â ÃƒÂ¢Ã¢â€šÂ¬Ã¢â€žÂ¢ÃƒÆ’Ã†â€™ÃƒÂ¢Ã¢â€šÂ¬Ã‚Â ÃƒÆ’Ã‚Â¢ÃƒÂ¢Ã¢â‚¬Å¡Ã‚Â¬ÃƒÂ¢Ã¢â‚¬Å¾Ã‚Â¢ÃƒÆ’Ã†â€™Ãƒâ€ Ã¢â‚¬â„¢ÃƒÆ’Ã‚Â¢ÃƒÂ¢Ã¢â‚¬Å¡Ã‚Â¬Ãƒâ€šÃ‚Â ÃƒÆ’Ã†â€™Ãƒâ€šÃ‚Â¢ÃƒÆ’Ã‚Â¢ÃƒÂ¢Ã¢â€šÂ¬Ã…Â¡Ãƒâ€šÃ‚Â¬ÃƒÆ’Ã‚Â¢ÃƒÂ¢Ã¢â€šÂ¬Ã…Â¾Ãƒâ€šÃ‚Â¢ÃƒÆ’Ã†â€™Ãƒâ€ Ã¢â‚¬â„¢ÃƒÆ’Ã¢â‚¬Â ÃƒÂ¢Ã¢â€šÂ¬Ã¢â€žÂ¢ÃƒÆ’Ã†â€™Ãƒâ€šÃ‚Â¢ÃƒÆ’Ã‚Â¢ÃƒÂ¢Ã¢â€šÂ¬Ã…Â¡Ãƒâ€šÃ‚Â¬ÃƒÆ’Ã¢â‚¬Å¡Ãƒâ€šÃ‚Â ÃƒÆ’Ã†â€™Ãƒâ€ Ã¢â‚¬â„¢ÃƒÆ’Ã¢â‚¬Å¡Ãƒâ€šÃ‚Â¢ÃƒÆ’Ã†â€™Ãƒâ€šÃ‚Â¢ÃƒÆ’Ã‚Â¢ÃƒÂ¢Ã¢â‚¬Å¡Ã‚Â¬Ãƒâ€¦Ã‚Â¡ÃƒÆ’Ã¢â‚¬Å¡Ãƒâ€šÃ‚Â¬ÃƒÆ’Ã†â€™Ãƒâ€šÃ‚Â¢ÃƒÆ’Ã‚Â¢ÃƒÂ¢Ã¢â‚¬Å¡Ã‚Â¬Ãƒâ€¦Ã‚Â¾ÃƒÆ’Ã¢â‚¬Å¡Ãƒâ€šÃ‚Â¢ÃƒÆ’Ã†â€™Ãƒâ€ Ã¢â‚¬â„¢ÃƒÆ’Ã¢â‚¬Â ÃƒÂ¢Ã¢â€šÂ¬Ã¢â€žÂ¢ÃƒÆ’Ã†â€™ÃƒÂ¢Ã¢â€šÂ¬Ã‚Â ÃƒÆ’Ã‚Â¢ÃƒÂ¢Ã¢â‚¬Å¡Ã‚Â¬ÃƒÂ¢Ã¢â‚¬Å¾Ã‚Â¢ÃƒÆ’Ã†â€™Ãƒâ€ Ã¢â‚¬â„¢ÃƒÆ’Ã¢â‚¬Å¡Ãƒâ€šÃ‚Â¢ÃƒÆ’Ã†â€™Ãƒâ€šÃ‚Â¢ÃƒÆ’Ã‚Â¢ÃƒÂ¢Ã¢â‚¬Å¡Ã‚Â¬Ãƒâ€¦Ã‚Â¡ÃƒÆ’Ã¢â‚¬Å¡Ãƒâ€šÃ‚Â¬ÃƒÆ’Ã†â€™ÃƒÂ¢Ã¢â€šÂ¬Ã‚Â¦ÃƒÆ’Ã¢â‚¬Å¡Ãƒâ€šÃ‚Â¡ÃƒÆ’Ã†â€™Ãƒâ€ Ã¢â‚¬â„¢ÃƒÆ’Ã¢â‚¬Â ÃƒÂ¢Ã¢â€šÂ¬Ã¢â€žÂ¢ÃƒÆ’Ã†â€™Ãƒâ€šÃ‚Â¢ÃƒÆ’Ã‚Â¢ÃƒÂ¢Ã¢â€šÂ¬Ã…Â¡Ãƒâ€šÃ‚Â¬ÃƒÆ’Ã¢â‚¬Â¦Ãƒâ€šÃ‚Â¡ÃƒÆ’Ã†â€™Ãƒâ€ Ã¢â‚¬â„¢ÃƒÆ’Ã‚Â¢ÃƒÂ¢Ã¢â‚¬Å¡Ã‚Â¬Ãƒâ€¦Ã‚Â¡ÃƒÆ’Ã†â€™ÃƒÂ¢Ã¢â€šÂ¬Ã…Â¡ÃƒÆ’Ã¢â‚¬Å¡Ãƒâ€šÃ‚Â¢ÃƒÆ’Ã†â€™Ãƒâ€ Ã¢â‚¬â„¢ÃƒÆ’Ã¢â‚¬Â ÃƒÂ¢Ã¢â€šÂ¬Ã¢â€žÂ¢ÃƒÆ’Ã†â€™ÃƒÂ¢Ã¢â€šÂ¬Ã‚Â ÃƒÆ’Ã‚Â¢ÃƒÂ¢Ã¢â‚¬Å¡Ã‚Â¬ÃƒÂ¢Ã¢â‚¬Å¾Ã‚Â¢ÃƒÆ’Ã†â€™Ãƒâ€ Ã¢â‚¬â„¢ÃƒÆ’Ã‚Â¢ÃƒÂ¢Ã¢â‚¬Å¡Ã‚Â¬Ãƒâ€šÃ‚Â ÃƒÆ’Ã†â€™Ãƒâ€šÃ‚Â¢ÃƒÆ’Ã‚Â¢ÃƒÂ¢Ã¢â€šÂ¬Ã…Â¡Ãƒâ€šÃ‚Â¬ÃƒÆ’Ã‚Â¢ÃƒÂ¢Ã¢â€šÂ¬Ã…Â¾Ãƒâ€šÃ‚Â¢ÃƒÆ’Ã†â€™Ãƒâ€ Ã¢â‚¬â„¢ÃƒÆ’Ã¢â‚¬Â ÃƒÂ¢Ã¢â€šÂ¬Ã¢â€žÂ¢ÃƒÆ’Ã†â€™Ãƒâ€šÃ‚Â¢ÃƒÆ’Ã‚Â¢ÃƒÂ¢Ã¢â€šÂ¬Ã…Â¡Ãƒâ€šÃ‚Â¬ÃƒÆ’Ã¢â‚¬Â¦Ãƒâ€šÃ‚Â¡ÃƒÆ’Ã†â€™Ãƒâ€ Ã¢â‚¬â„¢ÃƒÆ’Ã‚Â¢ÃƒÂ¢Ã¢â‚¬Å¡Ã‚Â¬Ãƒâ€¦Ã‚Â¡ÃƒÆ’Ã†â€™ÃƒÂ¢Ã¢â€šÂ¬Ã…Â¡ÃƒÆ’Ã¢â‚¬Å¡Ãƒâ€šÃ‚Â¢ÃƒÆ’Ã†â€™Ãƒâ€ Ã¢â‚¬â„¢ÃƒÆ’Ã¢â‚¬Â ÃƒÂ¢Ã¢â€šÂ¬Ã¢â€žÂ¢ÃƒÆ’Ã†â€™ÃƒÂ¢Ã¢â€šÂ¬Ã‚Â ÃƒÆ’Ã‚Â¢ÃƒÂ¢Ã¢â‚¬Å¡Ã‚Â¬ÃƒÂ¢Ã¢â‚¬Å¾Ã‚Â¢ÃƒÆ’Ã†â€™Ãƒâ€ Ã¢â‚¬â„¢ÃƒÆ’Ã‚Â¢ÃƒÂ¢Ã¢â‚¬Å¡Ã‚Â¬Ãƒâ€¦Ã‚Â¡ÃƒÆ’Ã†â€™ÃƒÂ¢Ã¢â€šÂ¬Ã…Â¡ÃƒÆ’Ã¢â‚¬Å¡Ãƒâ€šÃ‚Â¢ÃƒÆ’Ã†â€™Ãƒâ€ Ã¢â‚¬â„¢ÃƒÆ’Ã¢â‚¬Â ÃƒÂ¢Ã¢â€šÂ¬Ã¢â€žÂ¢ÃƒÆ’Ã†â€™ÃƒÂ¢Ã¢â€šÂ¬Ã…Â¡ÃƒÆ’Ã¢â‚¬Å¡Ãƒâ€šÃ‚Â¢ÃƒÆ’Ã†â€™Ãƒâ€ Ã¢â‚¬â„¢ÃƒÆ’Ã¢â‚¬Å¡Ãƒâ€šÃ‚Â¢ÃƒÆ’Ã†â€™Ãƒâ€šÃ‚Â¢ÃƒÆ’Ã‚Â¢ÃƒÂ¢Ã¢â€šÂ¬Ã…Â¡Ãƒâ€šÃ‚Â¬ÃƒÆ’Ã¢â‚¬Â¦Ãƒâ€šÃ‚Â¡ÃƒÆ’Ã†â€™ÃƒÂ¢Ã¢â€šÂ¬Ã…Â¡ÃƒÆ’Ã¢â‚¬Å¡Ãƒâ€šÃ‚Â¬ÃƒÆ’Ã†â€™Ãƒâ€ Ã¢â‚¬â„¢ÃƒÆ’Ã‚Â¢ÃƒÂ¢Ã¢â‚¬Å¡Ã‚Â¬Ãƒâ€šÃ‚Â¦ÃƒÆ’Ã†â€™ÃƒÂ¢Ã¢â€šÂ¬Ã…Â¡ÃƒÆ’Ã¢â‚¬Å¡Ãƒâ€šÃ‚Â¡ÃƒÆ’Ã†â€™Ãƒâ€ Ã¢â‚¬â„¢ÃƒÆ’Ã¢â‚¬Â ÃƒÂ¢Ã¢â€šÂ¬Ã¢â€žÂ¢ÃƒÆ’Ã†â€™Ãƒâ€šÃ‚Â¢ÃƒÆ’Ã‚Â¢ÃƒÂ¢Ã¢â€šÂ¬Ã…Â¡Ãƒâ€šÃ‚Â¬ÃƒÆ’Ã¢â‚¬Â¦Ãƒâ€šÃ‚Â¡ÃƒÆ’Ã†â€™Ãƒâ€ Ã¢â‚¬â„¢ÃƒÆ’Ã‚Â¢ÃƒÂ¢Ã¢â‚¬Å¡Ã‚Â¬Ãƒâ€¦Ã‚Â¡ÃƒÆ’Ã†â€™ÃƒÂ¢Ã¢â€šÂ¬Ã…Â¡ÃƒÆ’Ã¢â‚¬Å¡Ãƒâ€šÃ‚Â¬ÃƒÆ’Ã†â€™Ãƒâ€ Ã¢â‚¬â„¢ÃƒÆ’Ã¢â‚¬Â ÃƒÂ¢Ã¢â€šÂ¬Ã¢â€žÂ¢ÃƒÆ’Ã†â€™ÃƒÂ¢Ã¢â€šÂ¬Ã‚Â ÃƒÆ’Ã‚Â¢ÃƒÂ¢Ã¢â‚¬Å¡Ã‚Â¬ÃƒÂ¢Ã¢â‚¬Å¾Ã‚Â¢ÃƒÆ’Ã†â€™Ãƒâ€ Ã¢â‚¬â„¢ÃƒÆ’Ã¢â‚¬Å¡Ãƒâ€šÃ‚Â¢ÃƒÆ’Ã†â€™Ãƒâ€šÃ‚Â¢ÃƒÆ’Ã‚Â¢ÃƒÂ¢Ã¢â‚¬Å¡Ã‚Â¬Ãƒâ€¦Ã‚Â¡ÃƒÆ’Ã¢â‚¬Å¡Ãƒâ€šÃ‚Â¬ÃƒÆ’Ã†â€™ÃƒÂ¢Ã¢â€šÂ¬Ã…Â¡ÃƒÆ’Ã¢â‚¬Å¡Ãƒâ€šÃ‚Â¦ÃƒÆ’Ã†â€™Ãƒâ€ Ã¢â‚¬â„¢ÃƒÆ’Ã¢â‚¬Â ÃƒÂ¢Ã¢â€šÂ¬Ã¢â€žÂ¢ÃƒÆ’Ã†â€™Ãƒâ€šÃ‚Â¢ÃƒÆ’Ã‚Â¢ÃƒÂ¢Ã¢â€šÂ¬Ã…Â¡Ãƒâ€šÃ‚Â¬ÃƒÆ’Ã¢â‚¬Â¦Ãƒâ€šÃ‚Â¡ÃƒÆ’Ã†â€™Ãƒâ€ Ã¢â‚¬â„¢ÃƒÆ’Ã‚Â¢ÃƒÂ¢Ã¢â‚¬Å¡Ã‚Â¬Ãƒâ€¦Ã‚Â¡ÃƒÆ’Ã†â€™ÃƒÂ¢Ã¢â€šÂ¬Ã…Â¡ÃƒÆ’Ã¢â‚¬Å¡Ãƒâ€šÃ‚Â¡ÃƒÆ’Ã†â€™Ãƒâ€ Ã¢â‚¬â„¢ÃƒÆ’Ã¢â‚¬Â ÃƒÂ¢Ã¢â€šÂ¬Ã¢â€žÂ¢ÃƒÆ’Ã†â€™ÃƒÂ¢Ã¢â€šÂ¬Ã‚Â ÃƒÆ’Ã‚Â¢ÃƒÂ¢Ã¢â‚¬Å¡Ã‚Â¬ÃƒÂ¢Ã¢â‚¬Å¾Ã‚Â¢ÃƒÆ’Ã†â€™Ãƒâ€ Ã¢â‚¬â„¢ÃƒÆ’Ã‚Â¢ÃƒÂ¢Ã¢â‚¬Å¡Ã‚Â¬Ãƒâ€šÃ‚Â ÃƒÆ’Ã†â€™Ãƒâ€šÃ‚Â¢ÃƒÆ’Ã‚Â¢ÃƒÂ¢Ã¢â€šÂ¬Ã…Â¡Ãƒâ€šÃ‚Â¬ÃƒÆ’Ã‚Â¢ÃƒÂ¢Ã¢â€šÂ¬Ã…Â¾Ãƒâ€šÃ‚Â¢ÃƒÆ’Ã†â€™Ãƒâ€ Ã¢â‚¬â„¢ÃƒÆ’Ã¢â‚¬Â ÃƒÂ¢Ã¢â€šÂ¬Ã¢â€žÂ¢ÃƒÆ’Ã†â€™ÃƒÂ¢Ã¢â€šÂ¬Ã…Â¡ÃƒÆ’Ã¢â‚¬Å¡Ãƒâ€šÃ‚Â¢ÃƒÆ’Ã†â€™Ãƒâ€ Ã¢â‚¬â„¢ÃƒÆ’Ã¢â‚¬Å¡Ãƒâ€šÃ‚Â¢ÃƒÆ’Ã†â€™Ãƒâ€šÃ‚Â¢ÃƒÆ’Ã‚Â¢ÃƒÂ¢Ã¢â€šÂ¬Ã…Â¡Ãƒâ€šÃ‚Â¬ÃƒÆ’Ã¢â‚¬Â¦Ãƒâ€šÃ‚Â¡ÃƒÆ’Ã†â€™ÃƒÂ¢Ã¢â€šÂ¬Ã…Â¡ÃƒÆ’Ã¢â‚¬Å¡Ãƒâ€šÃ‚Â¬ÃƒÆ’Ã†â€™Ãƒâ€ Ã¢â‚¬â„¢ÃƒÆ’Ã‚Â¢ÃƒÂ¢Ã¢â‚¬Å¡Ã‚Â¬Ãƒâ€šÃ‚Â¦ÃƒÆ’Ã†â€™ÃƒÂ¢Ã¢â€šÂ¬Ã…Â¡ÃƒÆ’Ã¢â‚¬Å¡Ãƒâ€šÃ‚Â¡ÃƒÆ’Ã†â€™Ãƒâ€ Ã¢â‚¬â„¢ÃƒÆ’Ã¢â‚¬Â ÃƒÂ¢Ã¢â€šÂ¬Ã¢â€žÂ¢ÃƒÆ’Ã†â€™ÃƒÂ¢Ã¢â€šÂ¬Ã‚Â ÃƒÆ’Ã‚Â¢ÃƒÂ¢Ã¢â‚¬Å¡Ã‚Â¬ÃƒÂ¢Ã¢â‚¬Å¾Ã‚Â¢ÃƒÆ’Ã†â€™Ãƒâ€ Ã¢â‚¬â„¢ÃƒÆ’Ã¢â‚¬Å¡Ãƒâ€šÃ‚Â¢ÃƒÆ’Ã†â€™Ãƒâ€šÃ‚Â¢ÃƒÆ’Ã‚Â¢ÃƒÂ¢Ã¢â‚¬Å¡Ã‚Â¬Ãƒâ€¦Ã‚Â¡ÃƒÆ’Ã¢â‚¬Å¡Ãƒâ€šÃ‚Â¬ÃƒÆ’Ã†â€™ÃƒÂ¢Ã¢â€šÂ¬Ã‚Â¦ÃƒÆ’Ã¢â‚¬Å¡Ãƒâ€šÃ‚Â¡ÃƒÆ’Ã†â€™Ãƒâ€ Ã¢â‚¬â„¢ÃƒÆ’Ã¢â‚¬Â ÃƒÂ¢Ã¢â€šÂ¬Ã¢â€žÂ¢ÃƒÆ’Ã†â€™Ãƒâ€šÃ‚Â¢ÃƒÆ’Ã‚Â¢ÃƒÂ¢Ã¢â€šÂ¬Ã…Â¡Ãƒâ€šÃ‚Â¬ÃƒÆ’Ã¢â‚¬Â¦Ãƒâ€šÃ‚Â¡ÃƒÆ’Ã†â€™Ãƒâ€ Ã¢â‚¬â„¢ÃƒÆ’Ã‚Â¢ÃƒÂ¢Ã¢â‚¬Å¡Ã‚Â¬Ãƒâ€¦Ã‚Â¡ÃƒÆ’Ã†â€™ÃƒÂ¢Ã¢â€šÂ¬Ã…Â¡ÃƒÆ’Ã¢â‚¬Å¡Ãƒâ€šÃ‚Â¬ÃƒÆ’Ã†â€™Ãƒâ€ Ã¢â‚¬â„¢ÃƒÆ’Ã¢â‚¬Â ÃƒÂ¢Ã¢â€šÂ¬Ã¢â€žÂ¢ÃƒÆ’Ã†â€™ÃƒÂ¢Ã¢â€šÂ¬Ã‚Â ÃƒÆ’Ã‚Â¢ÃƒÂ¢Ã¢â‚¬Å¡Ã‚Â¬ÃƒÂ¢Ã¢â‚¬Å¾Ã‚Â¢ÃƒÆ’Ã†â€™Ãƒâ€ Ã¢â‚¬â„¢ÃƒÆ’Ã‚Â¢ÃƒÂ¢Ã¢â‚¬Å¡Ã‚Â¬Ãƒâ€šÃ‚Â ÃƒÆ’Ã†â€™Ãƒâ€šÃ‚Â¢ÃƒÆ’Ã‚Â¢ÃƒÂ¢Ã¢â€šÂ¬Ã…Â¡Ãƒâ€šÃ‚Â¬ÃƒÆ’Ã‚Â¢ÃƒÂ¢Ã¢â€šÂ¬Ã…Â¾Ãƒâ€šÃ‚Â¢ÃƒÆ’Ã†â€™Ãƒâ€ Ã¢â‚¬â„¢ÃƒÆ’Ã¢â‚¬Â ÃƒÂ¢Ã¢â€šÂ¬Ã¢â€žÂ¢ÃƒÆ’Ã†â€™Ãƒâ€šÃ‚Â¢ÃƒÆ’Ã‚Â¢ÃƒÂ¢Ã¢â€šÂ¬Ã…Â¡Ãƒâ€šÃ‚Â¬ÃƒÆ’Ã¢â‚¬Å¡Ãƒâ€šÃ‚Â ÃƒÆ’Ã†â€™Ãƒâ€ Ã¢â‚¬â„¢ÃƒÆ’Ã¢â‚¬Å¡Ãƒâ€šÃ‚Â¢ÃƒÆ’Ã†â€™Ãƒâ€šÃ‚Â¢ÃƒÆ’Ã‚Â¢ÃƒÂ¢Ã¢â‚¬Å¡Ã‚Â¬Ãƒâ€¦Ã‚Â¡ÃƒÆ’Ã¢â‚¬Å¡Ãƒâ€šÃ‚Â¬ÃƒÆ’Ã†â€™Ãƒâ€šÃ‚Â¢ÃƒÆ’Ã‚Â¢ÃƒÂ¢Ã¢â‚¬Å¡Ã‚Â¬Ãƒâ€¦Ã‚Â¾ÃƒÆ’Ã¢â‚¬Å¡Ãƒâ€šÃ‚Â¢ÃƒÆ’Ã†â€™Ãƒâ€ Ã¢â‚¬â„¢ÃƒÆ’Ã¢â‚¬Â ÃƒÂ¢Ã¢â€šÂ¬Ã¢â€žÂ¢ÃƒÆ’Ã†â€™ÃƒÂ¢Ã¢â€šÂ¬Ã‚Â ÃƒÆ’Ã‚Â¢ÃƒÂ¢Ã¢â‚¬Å¡Ã‚Â¬ÃƒÂ¢Ã¢â‚¬Å¾Ã‚Â¢ÃƒÆ’Ã†â€™Ãƒâ€ Ã¢â‚¬â„¢ÃƒÆ’Ã¢â‚¬Å¡Ãƒâ€šÃ‚Â¢ÃƒÆ’Ã†â€™Ãƒâ€šÃ‚Â¢ÃƒÆ’Ã‚Â¢ÃƒÂ¢Ã¢â‚¬Å¡Ã‚Â¬Ãƒâ€¦Ã‚Â¡ÃƒÆ’Ã¢â‚¬Å¡Ãƒâ€šÃ‚Â¬ÃƒÆ’Ã†â€™ÃƒÂ¢Ã¢â€šÂ¬Ã‚Â¦ÃƒÆ’Ã¢â‚¬Å¡Ãƒâ€šÃ‚Â¡ÃƒÆ’Ã†â€™Ãƒâ€ Ã¢â‚¬â„¢ÃƒÆ’Ã¢â‚¬Â ÃƒÂ¢Ã¢â€šÂ¬Ã¢â€žÂ¢ÃƒÆ’Ã†â€™Ãƒâ€šÃ‚Â¢ÃƒÆ’Ã‚Â¢ÃƒÂ¢Ã¢â€šÂ¬Ã…Â¡Ãƒâ€šÃ‚Â¬ÃƒÆ’Ã¢â‚¬Â¦Ãƒâ€šÃ‚Â¡ÃƒÆ’Ã†â€™Ãƒâ€ Ã¢â‚¬â„¢ÃƒÆ’Ã‚Â¢ÃƒÂ¢Ã¢â‚¬Å¡Ã‚Â¬Ãƒâ€¦Ã‚Â¡ÃƒÆ’Ã†â€™ÃƒÂ¢Ã¢â€šÂ¬Ã…Â¡ÃƒÆ’Ã¢â‚¬Å¡Ãƒâ€šÃ‚Â¢ÃƒÆ’Ã†â€™Ãƒâ€ Ã¢â‚¬â„¢ÃƒÆ’Ã¢â‚¬Â ÃƒÂ¢Ã¢â€šÂ¬Ã¢â€žÂ¢ÃƒÆ’Ã†â€™ÃƒÂ¢Ã¢â€šÂ¬Ã‚Â ÃƒÆ’Ã‚Â¢ÃƒÂ¢Ã¢â‚¬Å¡Ã‚Â¬ÃƒÂ¢Ã¢â‚¬Å¾Ã‚Â¢ÃƒÆ’Ã†â€™Ãƒâ€ Ã¢â‚¬â„¢ÃƒÆ’Ã‚Â¢ÃƒÂ¢Ã¢â‚¬Å¡Ã‚Â¬Ãƒâ€šÃ‚Â ÃƒÆ’Ã†â€™Ãƒâ€šÃ‚Â¢ÃƒÆ’Ã‚Â¢ÃƒÂ¢Ã¢â€šÂ¬Ã…Â¡Ãƒâ€šÃ‚Â¬ÃƒÆ’Ã‚Â¢ÃƒÂ¢Ã¢â€šÂ¬Ã…Â¾Ãƒâ€šÃ‚Â¢ÃƒÆ’Ã†â€™Ãƒâ€ Ã¢â‚¬â„¢ÃƒÆ’Ã¢â‚¬Â ÃƒÂ¢Ã¢â€šÂ¬Ã¢â€žÂ¢ÃƒÆ’Ã†â€™Ãƒâ€šÃ‚Â¢ÃƒÆ’Ã‚Â¢ÃƒÂ¢Ã¢â€šÂ¬Ã…Â¡Ãƒâ€šÃ‚Â¬ÃƒÆ’Ã¢â‚¬Â¦Ãƒâ€šÃ‚Â¡ÃƒÆ’Ã†â€™Ãƒâ€ Ã¢â‚¬â„¢ÃƒÆ’Ã‚Â¢ÃƒÂ¢Ã¢â‚¬Å¡Ã‚Â¬Ãƒâ€¦Ã‚Â¡ÃƒÆ’Ã†â€™ÃƒÂ¢Ã¢â€šÂ¬Ã…Â¡ÃƒÆ’Ã¢â‚¬Å¡Ãƒâ€šÃ‚Â¢ÃƒÆ’Ã†â€™Ãƒâ€ Ã¢â‚¬â„¢ÃƒÆ’Ã¢â‚¬Â ÃƒÂ¢Ã¢â€šÂ¬Ã¢â€žÂ¢ÃƒÆ’Ã†â€™ÃƒÂ¢Ã¢â€šÂ¬Ã‚Â ÃƒÆ’Ã‚Â¢ÃƒÂ¢Ã¢â‚¬Å¡Ã‚Â¬ÃƒÂ¢Ã¢â‚¬Å¾Ã‚Â¢ÃƒÆ’Ã†â€™Ãƒâ€ Ã¢â‚¬â„¢ÃƒÆ’Ã‚Â¢ÃƒÂ¢Ã¢â‚¬Å¡Ã‚Â¬Ãƒâ€¦Ã‚Â¡ÃƒÆ’Ã†â€™ÃƒÂ¢Ã¢â€šÂ¬Ã…Â¡ÃƒÆ’Ã¢â‚¬Å¡Ãƒâ€šÃ‚Â¢ÃƒÆ’Ã†â€™Ãƒâ€ Ã¢â‚¬â„¢ÃƒÆ’Ã¢â‚¬Â ÃƒÂ¢Ã¢â€šÂ¬Ã¢â€žÂ¢ÃƒÆ’Ã†â€™ÃƒÂ¢Ã¢â€šÂ¬Ã…Â¡ÃƒÆ’Ã¢â‚¬Å¡Ãƒâ€šÃ‚Â¢ÃƒÆ’Ã†â€™Ãƒâ€ Ã¢â‚¬â„¢ÃƒÆ’Ã¢â‚¬Å¡Ãƒâ€šÃ‚Â¢ÃƒÆ’Ã†â€™Ãƒâ€šÃ‚Â¢ÃƒÆ’Ã‚Â¢ÃƒÂ¢Ã¢â‚¬Å¡Ã‚Â¬Ãƒâ€¦Ã‚Â¡ÃƒÆ’Ã¢â‚¬Å¡Ãƒâ€šÃ‚Â¬ÃƒÆ’Ã†â€™ÃƒÂ¢Ã¢â€šÂ¬Ã‚Â¦ÃƒÆ’Ã¢â‚¬Å¡Ãƒâ€šÃ‚Â¡ÃƒÆ’Ã†â€™Ãƒâ€ Ã¢â‚¬â„¢ÃƒÆ’Ã‚Â¢ÃƒÂ¢Ã¢â‚¬Å¡Ã‚Â¬Ãƒâ€¦Ã‚Â¡ÃƒÆ’Ã†â€™ÃƒÂ¢Ã¢â€šÂ¬Ã…Â¡ÃƒÆ’Ã¢â‚¬Å¡Ãƒâ€šÃ‚Â¬ÃƒÆ’Ã†â€™Ãƒâ€ Ã¢â‚¬â„¢ÃƒÆ’Ã¢â‚¬Â ÃƒÂ¢Ã¢â€šÂ¬Ã¢â€žÂ¢ÃƒÆ’Ã†â€™Ãƒâ€šÃ‚Â¢ÃƒÆ’Ã‚Â¢ÃƒÂ¢Ã¢â€šÂ¬Ã…Â¡Ãƒâ€šÃ‚Â¬ÃƒÆ’Ã¢â‚¬Å¡Ãƒâ€šÃ‚Â¦ÃƒÆ’Ã†â€™Ãƒâ€ Ã¢â‚¬â„¢ÃƒÆ’Ã‚Â¢ÃƒÂ¢Ã¢â‚¬Å¡Ã‚Â¬Ãƒâ€¦Ã‚Â¡ÃƒÆ’Ã†â€™ÃƒÂ¢Ã¢â€šÂ¬Ã…Â¡ÃƒÆ’Ã¢â‚¬Å¡Ãƒâ€šÃ‚Â¡ÃƒÆ’Ã†â€™Ãƒâ€ Ã¢â‚¬â„¢ÃƒÆ’Ã¢â‚¬Â ÃƒÂ¢Ã¢â€šÂ¬Ã¢â€žÂ¢ÃƒÆ’Ã†â€™ÃƒÂ¢Ã¢â€šÂ¬Ã‚Â ÃƒÆ’Ã‚Â¢ÃƒÂ¢Ã¢â‚¬Å¡Ã‚Â¬ÃƒÂ¢Ã¢â‚¬Å¾Ã‚Â¢ÃƒÆ’Ã†â€™Ãƒâ€ Ã¢â‚¬â„¢ÃƒÆ’Ã¢â‚¬Å¡Ãƒâ€šÃ‚Â¢ÃƒÆ’Ã†â€™Ãƒâ€šÃ‚Â¢ÃƒÆ’Ã‚Â¢ÃƒÂ¢Ã¢â‚¬Å¡Ã‚Â¬Ãƒâ€¦Ã‚Â¡ÃƒÆ’Ã¢â‚¬Å¡Ãƒâ€šÃ‚Â¬ÃƒÆ’Ã†â€™ÃƒÂ¢Ã¢â€šÂ¬Ã‚Â¦ÃƒÆ’Ã¢â‚¬Å¡Ãƒâ€šÃ‚Â¡ÃƒÆ’Ã†â€™Ãƒâ€ Ã¢â‚¬â„¢ÃƒÆ’Ã¢â‚¬Â ÃƒÂ¢Ã¢â€šÂ¬Ã¢â€žÂ¢ÃƒÆ’Ã†â€™Ãƒâ€šÃ‚Â¢ÃƒÆ’Ã‚Â¢ÃƒÂ¢Ã¢â€šÂ¬Ã…Â¡Ãƒâ€šÃ‚Â¬ÃƒÆ’Ã¢â‚¬Â¦Ãƒâ€šÃ‚Â¡ÃƒÆ’Ã†â€™Ãƒâ€ Ã¢â‚¬â„¢ÃƒÆ’Ã‚Â¢ÃƒÂ¢Ã¢â‚¬Å¡Ã‚Â¬Ãƒâ€¦Ã‚Â¡ÃƒÆ’Ã†â€™ÃƒÂ¢Ã¢â€šÂ¬Ã…Â¡ÃƒÆ’Ã¢â‚¬Å¡Ãƒâ€šÃ‚Â¬ÃƒÆ’Ã†â€™Ãƒâ€ Ã¢â‚¬â„¢ÃƒÆ’Ã¢â‚¬Â ÃƒÂ¢Ã¢â€šÂ¬Ã¢â€žÂ¢ÃƒÆ’Ã†â€™ÃƒÂ¢Ã¢â€šÂ¬Ã‚Â ÃƒÆ’Ã‚Â¢ÃƒÂ¢Ã¢â‚¬Å¡Ã‚Â¬ÃƒÂ¢Ã¢â‚¬Å¾Ã‚Â¢ÃƒÆ’Ã†â€™Ãƒâ€ Ã¢â‚¬â„¢ÃƒÆ’Ã‚Â¢ÃƒÂ¢Ã¢â‚¬Å¡Ã‚Â¬Ãƒâ€šÃ‚Â ÃƒÆ’Ã†â€™Ãƒâ€šÃ‚Â¢ÃƒÆ’Ã‚Â¢ÃƒÂ¢Ã¢â€šÂ¬Ã…Â¡Ãƒâ€šÃ‚Â¬ÃƒÆ’Ã‚Â¢ÃƒÂ¢Ã¢â€šÂ¬Ã…Â¾Ãƒâ€šÃ‚Â¢ÃƒÆ’Ã†â€™Ãƒâ€ Ã¢â‚¬â„¢ÃƒÆ’Ã¢â‚¬Â ÃƒÂ¢Ã¢â€šÂ¬Ã¢â€žÂ¢ÃƒÆ’Ã†â€™ÃƒÂ¢Ã¢â€šÂ¬Ã…Â¡ÃƒÆ’Ã¢â‚¬Å¡Ãƒâ€šÃ‚Â¢ÃƒÆ’Ã†â€™Ãƒâ€ Ã¢â‚¬â„¢ÃƒÆ’Ã¢â‚¬Å¡Ãƒâ€šÃ‚Â¢ÃƒÆ’Ã†â€™Ãƒâ€šÃ‚Â¢ÃƒÆ’Ã‚Â¢ÃƒÂ¢Ã¢â€šÂ¬Ã…Â¡Ãƒâ€šÃ‚Â¬ÃƒÆ’Ã¢â‚¬Â¦Ãƒâ€šÃ‚Â¡ÃƒÆ’Ã†â€™ÃƒÂ¢Ã¢â€šÂ¬Ã…Â¡ÃƒÆ’Ã¢â‚¬Å¡Ãƒâ€šÃ‚Â¬ÃƒÆ’Ã†â€™Ãƒâ€ Ã¢â‚¬â„¢ÃƒÆ’Ã‚Â¢ÃƒÂ¢Ã¢â‚¬Å¡Ã‚Â¬Ãƒâ€¦Ã‚Â¡ÃƒÆ’Ã†â€™ÃƒÂ¢Ã¢â€šÂ¬Ã…Â¡ÃƒÆ’Ã¢â‚¬Å¡Ãƒâ€šÃ‚Â¦ÃƒÆ’Ã†â€™Ãƒâ€ Ã¢â‚¬â„¢ÃƒÆ’Ã¢â‚¬Â ÃƒÂ¢Ã¢â€šÂ¬Ã¢â€žÂ¢ÃƒÆ’Ã†â€™ÃƒÂ¢Ã¢â€šÂ¬Ã‚Â ÃƒÆ’Ã‚Â¢ÃƒÂ¢Ã¢â‚¬Å¡Ã‚Â¬ÃƒÂ¢Ã¢â‚¬Å¾Ã‚Â¢ÃƒÆ’Ã†â€™Ãƒâ€ Ã¢â‚¬â„¢ÃƒÆ’Ã‚Â¢ÃƒÂ¢Ã¢â‚¬Å¡Ã‚Â¬Ãƒâ€¦Ã‚Â¡ÃƒÆ’Ã†â€™ÃƒÂ¢Ã¢â€šÂ¬Ã…Â¡ÃƒÆ’Ã¢â‚¬Å¡Ãƒâ€šÃ‚Â¢ÃƒÆ’Ã†â€™Ãƒâ€ Ã¢â‚¬â„¢ÃƒÆ’Ã¢â‚¬Â ÃƒÂ¢Ã¢â€šÂ¬Ã¢â€žÂ¢ÃƒÆ’Ã†â€™ÃƒÂ¢Ã¢â€šÂ¬Ã…Â¡ÃƒÆ’Ã¢â‚¬Å¡Ãƒâ€šÃ‚Â¢ÃƒÆ’Ã†â€™Ãƒâ€ Ã¢â‚¬â„¢ÃƒÆ’Ã¢â‚¬Å¡Ãƒâ€šÃ‚Â¢ÃƒÆ’Ã†â€™Ãƒâ€šÃ‚Â¢ÃƒÆ’Ã‚Â¢ÃƒÂ¢Ã¢â‚¬Å¡Ã‚Â¬Ãƒâ€¦Ã‚Â¡ÃƒÆ’Ã¢â‚¬Å¡Ãƒâ€šÃ‚Â¬ÃƒÆ’Ã†â€™ÃƒÂ¢Ã¢â€šÂ¬Ã‚Â¦ÃƒÆ’Ã¢â‚¬Å¡Ãƒâ€šÃ‚Â¡ÃƒÆ’Ã†â€™Ãƒâ€ Ã¢â‚¬â„¢ÃƒÆ’Ã‚Â¢ÃƒÂ¢Ã¢â‚¬Å¡Ã‚Â¬Ãƒâ€¦Ã‚Â¡ÃƒÆ’Ã†â€™ÃƒÂ¢Ã¢â€šÂ¬Ã…Â¡ÃƒÆ’Ã¢â‚¬Å¡Ãƒâ€šÃ‚Â¬ÃƒÆ’Ã†â€™Ãƒâ€ Ã¢â‚¬â„¢ÃƒÆ’Ã¢â‚¬Â ÃƒÂ¢Ã¢â€šÂ¬Ã¢â€žÂ¢ÃƒÆ’Ã†â€™Ãƒâ€šÃ‚Â¢ÃƒÆ’Ã‚Â¢ÃƒÂ¢Ã¢â€šÂ¬Ã…Â¡Ãƒâ€šÃ‚Â¬ÃƒÆ’Ã¢â‚¬Å¡Ãƒâ€šÃ‚Â¦ÃƒÆ’Ã†â€™Ãƒâ€ Ã¢â‚¬â„¢ÃƒÆ’Ã¢â‚¬Å¡Ãƒâ€šÃ‚Â¢ÃƒÆ’Ã†â€™Ãƒâ€šÃ‚Â¢ÃƒÆ’Ã‚Â¢ÃƒÂ¢Ã¢â‚¬Å¡Ã‚Â¬Ãƒâ€¦Ã‚Â¡ÃƒÆ’Ã¢â‚¬Å¡Ãƒâ€šÃ‚Â¬ÃƒÆ’Ã†â€™ÃƒÂ¢Ã¢â€šÂ¬Ã‚Â¦ÃƒÆ’Ã‚Â¢ÃƒÂ¢Ã¢â‚¬Å¡Ã‚Â¬Ãƒâ€¦Ã¢â‚¬Å“Wk6), both systems recovered again, with Monoculture reaching the highest AGR (13.854 g/day) and IMTA recording 8.307 g/day. Overall, although the Monoculture system achieved higher peak growth rates, the IMTA system demonstrated more stable and consistent growth performance, </w:t>
       </w:r>
       <w:r>
         <w:rPr>
@@ -2466,21 +2466,21 @@
         <w:rPr>
           <w:rFonts w:ascii="Times New Roman" w:hAnsi="Times New Roman" w:cs="Times New Roman"/>
         </w:rPr>
-        <w:t xml:space="preserve"> (%/day) in IMTA and Monoculture systems across four sampling intervals. Overall, both treatments show fluctuating growth patterns, including phases of weight loss and recovery. During the initial adaptation phase (Wk2ÃƒÆ’Ã†â€™Ãƒâ€ Ã¢â‚¬â„¢ÃƒÆ’Ã¢â‚¬Â ÃƒÂ¢Ã¢â€šÂ¬Ã¢â€žÂ¢ÃƒÆ’Ã†â€™ÃƒÂ¢Ã¢â€šÂ¬Ã‚Â ÃƒÆ’Ã‚Â¢ÃƒÂ¢Ã¢â‚¬Å¡Ã‚Â¬ÃƒÂ¢Ã¢â‚¬Å¾Ã‚Â¢ÃƒÆ’Ã†â€™Ãƒâ€ Ã¢â‚¬â„¢ÃƒÆ’Ã‚Â¢ÃƒÂ¢Ã¢â‚¬Å¡Ã‚Â¬Ãƒâ€šÃ‚Â ÃƒÆ’Ã†â€™Ãƒâ€šÃ‚Â¢ÃƒÆ’Ã‚Â¢ÃƒÂ¢Ã¢â€šÂ¬Ã…Â¡Ãƒâ€šÃ‚Â¬ÃƒÆ’Ã‚Â¢ÃƒÂ¢Ã¢â€šÂ¬Ã…Â¾Ãƒâ€šÃ‚Â¢ÃƒÆ’Ã†â€™Ãƒâ€ Ã¢â‚¬â„¢ÃƒÆ’Ã¢â‚¬Â ÃƒÂ¢Ã¢â€šÂ¬Ã¢â€žÂ¢ÃƒÆ’Ã†â€™Ãƒâ€šÃ‚Â¢ÃƒÆ’Ã‚Â¢ÃƒÂ¢Ã¢â€šÂ¬Ã…Â¡Ãƒâ€šÃ‚Â¬ÃƒÆ’Ã¢â‚¬Å¡Ãƒâ€šÃ‚Â ÃƒÆ’Ã†â€™Ãƒâ€ Ã¢â‚¬â„¢ÃƒÆ’Ã¢â‚¬Å¡Ãƒâ€šÃ‚Â¢ÃƒÆ’Ã†â€™Ãƒâ€šÃ‚Â¢ÃƒÆ’Ã‚Â¢ÃƒÂ¢Ã¢â‚¬Å¡Ã‚Â¬Ãƒâ€¦Ã‚Â¡ÃƒÆ’Ã¢â‚¬Å¡Ãƒâ€šÃ‚Â¬ÃƒÆ’Ã†â€™Ãƒâ€šÃ‚Â¢ÃƒÆ’Ã‚Â¢ÃƒÂ¢Ã¢â‚¬Å¡Ã‚Â¬Ãƒâ€¦Ã‚Â¾ÃƒÆ’Ã¢â‚¬Å¡Ãƒâ€šÃ‚Â¢ÃƒÆ’Ã†â€™Ãƒâ€ Ã¢â‚¬â„¢ÃƒÆ’Ã¢â‚¬Â ÃƒÂ¢Ã¢â€šÂ¬Ã¢â€žÂ¢ÃƒÆ’Ã†â€™ÃƒÂ¢Ã¢â€šÂ¬Ã‚Â ÃƒÆ’Ã‚Â¢ÃƒÂ¢Ã¢â‚¬Å¡Ã‚Â¬ÃƒÂ¢Ã¢â‚¬Å¾Ã‚Â¢ÃƒÆ’Ã†â€™Ãƒâ€ Ã¢â‚¬â„¢ÃƒÆ’Ã¢â‚¬Å¡Ãƒâ€šÃ‚Â¢ÃƒÆ’Ã†â€™Ãƒâ€šÃ‚Â¢ÃƒÆ’Ã‚Â¢ÃƒÂ¢Ã¢â‚¬Å¡Ã‚Â¬Ãƒâ€¦Ã‚Â¡ÃƒÆ’Ã¢â‚¬Å¡Ãƒâ€šÃ‚Â¬ÃƒÆ’Ã†â€™ÃƒÂ¢Ã¢â€šÂ¬Ã‚Â¦ÃƒÆ’Ã¢â‚¬Å¡Ãƒâ€šÃ‚Â¡ÃƒÆ’Ã†â€™Ãƒâ€ Ã¢â‚¬â„¢ÃƒÆ’Ã¢â‚¬Â ÃƒÂ¢Ã¢â€šÂ¬Ã¢â€žÂ¢ÃƒÆ’Ã†â€™Ãƒâ€šÃ‚Â¢ÃƒÆ’Ã‚Â¢ÃƒÂ¢Ã¢â€šÂ¬Ã…Â¡Ãƒâ€šÃ‚Â¬ÃƒÆ’Ã¢â‚¬Â¦Ãƒâ€šÃ‚Â¡ÃƒÆ’Ã†â€™Ãƒâ€ Ã¢â‚¬â„¢ÃƒÆ’Ã‚Â¢ÃƒÂ¢Ã¢â‚¬Å¡Ã‚Â¬Ãƒâ€¦Ã‚Â¡ÃƒÆ’Ã†â€™ÃƒÂ¢Ã¢â€šÂ¬Ã…Â¡ÃƒÆ’Ã¢â‚¬Å¡Ãƒâ€šÃ‚Â¢ÃƒÆ’Ã†â€™Ãƒâ€ Ã¢â‚¬â„¢ÃƒÆ’Ã¢â‚¬Â ÃƒÂ¢Ã¢â€šÂ¬Ã¢â€žÂ¢ÃƒÆ’Ã†â€™ÃƒÂ¢Ã¢â€šÂ¬Ã‚Â ÃƒÆ’Ã‚Â¢ÃƒÂ¢Ã¢â‚¬Å¡Ã‚Â¬ÃƒÂ¢Ã¢â‚¬Å¾Ã‚Â¢ÃƒÆ’Ã†â€™Ãƒâ€ Ã¢â‚¬â„¢ÃƒÆ’Ã‚Â¢ÃƒÂ¢Ã¢â‚¬Å¡Ã‚Â¬Ãƒâ€šÃ‚Â ÃƒÆ’Ã†â€™Ãƒâ€šÃ‚Â¢ÃƒÆ’Ã‚Â¢ÃƒÂ¢Ã¢â€šÂ¬Ã…Â¡Ãƒâ€šÃ‚Â¬ÃƒÆ’Ã‚Â¢ÃƒÂ¢Ã¢â€šÂ¬Ã…Â¾Ãƒâ€šÃ‚Â¢ÃƒÆ’Ã†â€™Ãƒâ€ Ã¢â‚¬â„¢ÃƒÆ’Ã¢â‚¬Â ÃƒÂ¢Ã¢â€šÂ¬Ã¢â€žÂ¢ÃƒÆ’Ã†â€™Ãƒâ€šÃ‚Â¢ÃƒÆ’Ã‚Â¢ÃƒÂ¢Ã¢â€šÂ¬Ã…Â¡Ãƒâ€šÃ‚Â¬ÃƒÆ’Ã¢â‚¬Â¦Ãƒâ€šÃ‚Â¡ÃƒÆ’Ã†â€™Ãƒâ€ Ã¢â‚¬â„¢ÃƒÆ’Ã‚Â¢ÃƒÂ¢Ã¢â‚¬Å¡Ã‚Â¬Ãƒâ€¦Ã‚Â¡ÃƒÆ’Ã†â€™ÃƒÂ¢Ã¢â€šÂ¬Ã…Â¡ÃƒÆ’Ã¢â‚¬Å¡Ãƒâ€šÃ‚Â¢ÃƒÆ’Ã†â€™Ãƒâ€ Ã¢â‚¬â„¢ÃƒÆ’Ã¢â‚¬Â ÃƒÂ¢Ã¢â€šÂ¬Ã¢â€žÂ¢ÃƒÆ’Ã†â€™ÃƒÂ¢Ã¢â€šÂ¬Ã‚Â ÃƒÆ’Ã‚Â¢ÃƒÂ¢Ã¢â‚¬Å¡Ã‚Â¬ÃƒÂ¢Ã¢â‚¬Å¾Ã‚Â¢ÃƒÆ’Ã†â€™Ãƒâ€ Ã¢â‚¬â„¢ÃƒÆ’Ã‚Â¢ÃƒÂ¢Ã¢â‚¬Å¡Ã‚Â¬Ãƒâ€¦Ã‚Â¡ÃƒÆ’Ã†â€™ÃƒÂ¢Ã¢â€šÂ¬Ã…Â¡ÃƒÆ’Ã¢â‚¬Å¡Ãƒâ€šÃ‚Â¢ÃƒÆ’Ã†â€™Ãƒâ€ Ã¢â‚¬â„¢ÃƒÆ’Ã¢â‚¬Â ÃƒÂ¢Ã¢â€šÂ¬Ã¢â€žÂ¢ÃƒÆ’Ã†â€™ÃƒÂ¢Ã¢â€šÂ¬Ã…Â¡ÃƒÆ’Ã¢â‚¬Å¡Ãƒâ€šÃ‚Â¢ÃƒÆ’Ã†â€™Ãƒâ€ Ã¢â‚¬â„¢ÃƒÆ’Ã¢â‚¬Å¡Ãƒâ€šÃ‚Â¢ÃƒÆ’Ã†â€™Ãƒâ€šÃ‚Â¢ÃƒÆ’Ã‚Â¢ÃƒÂ¢Ã¢â‚¬Å¡Ã‚Â¬Ãƒâ€¦Ã‚Â¡ÃƒÆ’Ã¢â‚¬Å¡Ãƒâ€šÃ‚Â¬ÃƒÆ’Ã†â€™ÃƒÂ¢Ã¢â€šÂ¬Ã‚Â¦ÃƒÆ’Ã¢â‚¬Å¡Ãƒâ€šÃ‚Â¡ÃƒÆ’Ã†â€™Ãƒâ€ Ã¢â‚¬â„¢ÃƒÆ’Ã‚Â¢ÃƒÂ¢Ã¢â‚¬Å¡Ã‚Â¬Ãƒâ€¦Ã‚Â¡ÃƒÆ’Ã†â€™ÃƒÂ¢Ã¢â€šÂ¬Ã…Â¡ÃƒÆ’Ã¢â‚¬Å¡Ãƒâ€šÃ‚Â¬ÃƒÆ’Ã†â€™Ãƒâ€ Ã¢â‚¬â„¢ÃƒÆ’Ã¢â‚¬Â ÃƒÂ¢Ã¢â€šÂ¬Ã¢â€žÂ¢ÃƒÆ’Ã†â€™Ãƒâ€šÃ‚Â¢ÃƒÆ’Ã‚Â¢ÃƒÂ¢Ã¢â€šÂ¬Ã…Â¡Ãƒâ€šÃ‚Â¬ÃƒÆ’Ã¢â‚¬Å¡Ãƒâ€šÃ‚Â¦ÃƒÆ’Ã†â€™Ãƒâ€ Ã¢â‚¬â„¢ÃƒÆ’Ã‚Â¢ÃƒÂ¢Ã¢â‚¬Å¡Ã‚Â¬Ãƒâ€¦Ã‚Â¡ÃƒÆ’Ã†â€™ÃƒÂ¢Ã¢â€šÂ¬Ã…Â¡ÃƒÆ’Ã¢â‚¬Å¡Ãƒâ€šÃ‚Â¡ÃƒÆ’Ã†â€™Ãƒâ€ Ã¢â‚¬â„¢ÃƒÆ’Ã¢â‚¬Â ÃƒÂ¢Ã¢â€šÂ¬Ã¢â€žÂ¢ÃƒÆ’Ã†â€™ÃƒÂ¢Ã¢â€šÂ¬Ã‚Â ÃƒÆ’Ã‚Â¢ÃƒÂ¢Ã¢â‚¬Å¡Ã‚Â¬ÃƒÂ¢Ã¢â‚¬Å¾Ã‚Â¢ÃƒÆ’Ã†â€™Ãƒâ€ Ã¢â‚¬â„¢ÃƒÆ’Ã¢â‚¬Å¡Ãƒâ€šÃ‚Â¢ÃƒÆ’Ã†â€™Ãƒâ€šÃ‚Â¢ÃƒÆ’Ã‚Â¢ÃƒÂ¢Ã¢â‚¬Å¡Ã‚Â¬Ãƒâ€¦Ã‚Â¡ÃƒÆ’Ã¢â‚¬Å¡Ãƒâ€šÃ‚Â¬ÃƒÆ’Ã†â€™ÃƒÂ¢Ã¢â€šÂ¬Ã‚Â¦ÃƒÆ’Ã¢â‚¬Å¡Ãƒâ€šÃ‚Â¡ÃƒÆ’Ã†â€™Ãƒâ€ Ã¢â‚¬â„¢ÃƒÆ’Ã¢â‚¬Â ÃƒÂ¢Ã¢â€šÂ¬Ã¢â€žÂ¢ÃƒÆ’Ã†â€™Ãƒâ€šÃ‚Â¢ÃƒÆ’Ã‚Â¢ÃƒÂ¢Ã¢â€šÂ¬Ã…Â¡Ãƒâ€šÃ‚Â¬ÃƒÆ’Ã¢â‚¬Â¦Ãƒâ€šÃ‚Â¡ÃƒÆ’Ã†â€™Ãƒâ€ Ã¢â‚¬â„¢ÃƒÆ’Ã‚Â¢ÃƒÂ¢Ã¢â‚¬Å¡Ã‚Â¬Ãƒâ€¦Ã‚Â¡ÃƒÆ’Ã†â€™ÃƒÂ¢Ã¢â€šÂ¬Ã…Â¡ÃƒÆ’Ã¢â‚¬Å¡Ãƒâ€šÃ‚Â¬ÃƒÆ’Ã†â€™Ãƒâ€ Ã¢â‚¬â„¢ÃƒÆ’Ã¢â‚¬Â ÃƒÂ¢Ã¢â€šÂ¬Ã¢â€žÂ¢ÃƒÆ’Ã†â€™ÃƒÂ¢Ã¢â€šÂ¬Ã‚Â ÃƒÆ’Ã‚Â¢ÃƒÂ¢Ã¢â‚¬Å¡Ã‚Â¬ÃƒÂ¢Ã¢â‚¬Å¾Ã‚Â¢ÃƒÆ’Ã†â€™Ãƒâ€ Ã¢â‚¬â„¢ÃƒÆ’Ã‚Â¢ÃƒÂ¢Ã¢â‚¬Å¡Ã‚Â¬Ãƒâ€šÃ‚Â ÃƒÆ’Ã†â€™Ãƒâ€šÃ‚Â¢ÃƒÆ’Ã‚Â¢ÃƒÂ¢Ã¢â€šÂ¬Ã…Â¡Ãƒâ€šÃ‚Â¬ÃƒÆ’Ã‚Â¢ÃƒÂ¢Ã¢â€šÂ¬Ã…Â¾Ãƒâ€šÃ‚Â¢ÃƒÆ’Ã†â€™Ãƒâ€ Ã¢â‚¬â„¢ÃƒÆ’Ã¢â‚¬Â ÃƒÂ¢Ã¢â€šÂ¬Ã¢â€žÂ¢ÃƒÆ’Ã†â€™Ãƒâ€šÃ‚Â¢ÃƒÆ’Ã‚Â¢ÃƒÂ¢Ã¢â€šÂ¬Ã…Â¡Ãƒâ€šÃ‚Â¬ÃƒÆ’Ã¢â‚¬Â¦Ãƒâ€šÃ‚Â¡ÃƒÆ’Ã†â€™Ãƒâ€ Ã¢â‚¬â„¢ÃƒÆ’Ã‚Â¢ÃƒÂ¢Ã¢â‚¬Å¡Ã‚Â¬Ãƒâ€¦Ã‚Â¡ÃƒÆ’Ã†â€™ÃƒÂ¢Ã¢â€šÂ¬Ã…Â¡ÃƒÆ’Ã¢â‚¬Å¡Ãƒâ€šÃ‚Â¢ÃƒÆ’Ã†â€™Ãƒâ€ Ã¢â‚¬â„¢ÃƒÆ’Ã¢â‚¬Â ÃƒÂ¢Ã¢â€šÂ¬Ã¢â€žÂ¢ÃƒÆ’Ã†â€™ÃƒÂ¢Ã¢â€šÂ¬Ã‚Â ÃƒÆ’Ã‚Â¢ÃƒÂ¢Ã¢â‚¬Å¡Ã‚Â¬ÃƒÂ¢Ã¢â‚¬Å¾Ã‚Â¢ÃƒÆ’Ã†â€™Ãƒâ€ Ã¢â‚¬â„¢ÃƒÆ’Ã‚Â¢ÃƒÂ¢Ã¢â‚¬Å¡Ã‚Â¬Ãƒâ€¦Ã‚Â¡ÃƒÆ’Ã†â€™ÃƒÂ¢Ã¢â€šÂ¬Ã…Â¡ÃƒÆ’Ã¢â‚¬Å¡Ãƒâ€šÃ‚Â¢ÃƒÆ’Ã†â€™Ãƒâ€ Ã¢â‚¬â„¢ÃƒÆ’Ã¢â‚¬Â ÃƒÂ¢Ã¢â€šÂ¬Ã¢â€žÂ¢ÃƒÆ’Ã†â€™ÃƒÂ¢Ã¢â€šÂ¬Ã…Â¡ÃƒÆ’Ã¢â‚¬Å¡Ãƒâ€šÃ‚Â¢ÃƒÆ’Ã†â€™Ãƒâ€ Ã¢â‚¬â„¢ÃƒÆ’Ã¢â‚¬Å¡Ãƒâ€šÃ‚Â¢ÃƒÆ’Ã†â€™Ãƒâ€šÃ‚Â¢ÃƒÆ’Ã‚Â¢ÃƒÂ¢Ã¢â€šÂ¬Ã…Â¡Ãƒâ€šÃ‚Â¬ÃƒÆ’Ã¢â‚¬Â¦Ãƒâ€šÃ‚Â¡ÃƒÆ’Ã†â€™ÃƒÂ¢Ã¢â€šÂ¬Ã…Â¡ÃƒÆ’Ã¢â‚¬Å¡Ãƒâ€šÃ‚Â¬ÃƒÆ’Ã†â€™Ãƒâ€ Ã¢â‚¬â„¢ÃƒÆ’Ã‚Â¢ÃƒÂ¢Ã¢â‚¬Å¡Ã‚Â¬Ãƒâ€šÃ‚Â¦ÃƒÆ’Ã†â€™ÃƒÂ¢Ã¢â€šÂ¬Ã…Â¡ÃƒÆ’Ã¢â‚¬Å¡Ãƒâ€šÃ‚Â¡ÃƒÆ’Ã†â€™Ãƒâ€ Ã¢â‚¬â„¢ÃƒÆ’Ã¢â‚¬Â ÃƒÂ¢Ã¢â€šÂ¬Ã¢â€žÂ¢ÃƒÆ’Ã†â€™Ãƒâ€šÃ‚Â¢ÃƒÆ’Ã‚Â¢ÃƒÂ¢Ã¢â€šÂ¬Ã…Â¡Ãƒâ€šÃ‚Â¬ÃƒÆ’Ã¢â‚¬Â¦Ãƒâ€šÃ‚Â¡ÃƒÆ’Ã†â€™Ãƒâ€ Ã¢â‚¬â„¢ÃƒÆ’Ã‚Â¢ÃƒÂ¢Ã¢â‚¬Å¡Ã‚Â¬Ãƒâ€¦Ã‚Â¡ÃƒÆ’Ã†â€™ÃƒÂ¢Ã¢â€šÂ¬Ã…Â¡ÃƒÆ’Ã¢â‚¬Å¡Ãƒâ€šÃ‚Â¬ÃƒÆ’Ã†â€™Ãƒâ€ Ã¢â‚¬â„¢ÃƒÆ’Ã¢â‚¬Â ÃƒÂ¢Ã¢â€šÂ¬Ã¢â€žÂ¢ÃƒÆ’Ã†â€™ÃƒÂ¢Ã¢â€šÂ¬Ã‚Â ÃƒÆ’Ã‚Â¢ÃƒÂ¢Ã¢â‚¬Å¡Ã‚Â¬ÃƒÂ¢Ã¢â‚¬Å¾Ã‚Â¢ÃƒÆ’Ã†â€™Ãƒâ€ Ã¢â‚¬â„¢ÃƒÆ’Ã¢â‚¬Å¡Ãƒâ€šÃ‚Â¢ÃƒÆ’Ã†â€™Ãƒâ€šÃ‚Â¢ÃƒÆ’Ã‚Â¢ÃƒÂ¢Ã¢â‚¬Å¡Ã‚Â¬Ãƒâ€¦Ã‚Â¡ÃƒÆ’Ã¢â‚¬Å¡Ãƒâ€šÃ‚Â¬ÃƒÆ’Ã†â€™ÃƒÂ¢Ã¢â€šÂ¬Ã…Â¡ÃƒÆ’Ã¢â‚¬Å¡Ãƒâ€šÃ‚Â¦ÃƒÆ’Ã†â€™Ãƒâ€ Ã¢â‚¬â„¢ÃƒÆ’Ã¢â‚¬Â ÃƒÂ¢Ã¢â€šÂ¬Ã¢â€žÂ¢ÃƒÆ’Ã†â€™ÃƒÂ¢Ã¢â€šÂ¬Ã…Â¡ÃƒÆ’Ã¢â‚¬Å¡Ãƒâ€šÃ‚Â¢ÃƒÆ’Ã†â€™Ãƒâ€ Ã¢â‚¬â„¢ÃƒÆ’Ã¢â‚¬Å¡Ãƒâ€šÃ‚Â¢ÃƒÆ’Ã†â€™Ãƒâ€šÃ‚Â¢ÃƒÆ’Ã‚Â¢ÃƒÂ¢Ã¢â€šÂ¬Ã…Â¡Ãƒâ€šÃ‚Â¬ÃƒÆ’Ã¢â‚¬Â¦Ãƒâ€šÃ‚Â¡ÃƒÆ’Ã†â€™ÃƒÂ¢Ã¢â€šÂ¬Ã…Â¡ÃƒÆ’Ã¢â‚¬Å¡Ãƒâ€šÃ‚Â¬ÃƒÆ’Ã†â€™Ãƒâ€ Ã¢â‚¬â„¢ÃƒÆ’Ã‚Â¢ÃƒÂ¢Ã¢â‚¬Å¡Ã‚Â¬Ãƒâ€šÃ‚Â¦ÃƒÆ’Ã†â€™Ãƒâ€šÃ‚Â¢ÃƒÆ’Ã‚Â¢ÃƒÂ¢Ã¢â€šÂ¬Ã…Â¡Ãƒâ€šÃ‚Â¬ÃƒÆ’Ã¢â‚¬Â¦ÃƒÂ¢Ã¢â€šÂ¬Ã…â€œWk3), both systems recorded negative growth, with the IMTA group showing a slightly greater decline (-1.977%/day) compared to Monoculture (-0.985%/day). In the subsequent phase (Wk3ÃƒÆ’Ã†â€™Ãƒâ€ Ã¢â‚¬â„¢ÃƒÆ’Ã¢â‚¬Â ÃƒÂ¢Ã¢â€šÂ¬Ã¢â€žÂ¢ÃƒÆ’Ã†â€™ÃƒÂ¢Ã¢â€šÂ¬Ã‚Â ÃƒÆ’Ã‚Â¢ÃƒÂ¢Ã¢â‚¬Å¡Ã‚Â¬ÃƒÂ¢Ã¢â‚¬Å¾Ã‚Â¢ÃƒÆ’Ã†â€™Ãƒâ€ Ã¢â‚¬â„¢ÃƒÆ’Ã‚Â¢ÃƒÂ¢Ã¢â‚¬Å¡Ã‚Â¬Ãƒâ€šÃ‚Â ÃƒÆ’Ã†â€™Ãƒâ€šÃ‚Â¢ÃƒÆ’Ã‚Â¢ÃƒÂ¢Ã¢â€šÂ¬Ã…Â¡Ãƒâ€šÃ‚Â¬ÃƒÆ’Ã‚Â¢ÃƒÂ¢Ã¢â€šÂ¬Ã…Â¾Ãƒâ€šÃ‚Â¢ÃƒÆ’Ã†â€™Ãƒâ€ Ã¢â‚¬â„¢ÃƒÆ’Ã¢â‚¬Â ÃƒÂ¢Ã¢â€šÂ¬Ã¢â€žÂ¢ÃƒÆ’Ã†â€™Ãƒâ€šÃ‚Â¢ÃƒÆ’Ã‚Â¢ÃƒÂ¢Ã¢â€šÂ¬Ã…Â¡Ãƒâ€šÃ‚Â¬ÃƒÆ’Ã¢â‚¬Å¡Ãƒâ€šÃ‚Â ÃƒÆ’Ã†â€™Ãƒâ€ Ã¢â‚¬â„¢ÃƒÆ’Ã¢â‚¬Å¡Ãƒâ€šÃ‚Â¢ÃƒÆ’Ã†â€™Ãƒâ€šÃ‚Â¢ÃƒÆ’Ã‚Â¢ÃƒÂ¢Ã¢â‚¬Å¡Ã‚Â¬Ãƒâ€¦Ã‚Â¡ÃƒÆ’Ã¢â‚¬Å¡Ãƒâ€šÃ‚Â¬ÃƒÆ’Ã†â€™Ãƒâ€šÃ‚Â¢ÃƒÆ’Ã‚Â¢ÃƒÂ¢Ã¢â‚¬Å¡Ã‚Â¬Ãƒâ€¦Ã‚Â¾ÃƒÆ’Ã¢â‚¬Å¡Ãƒâ€šÃ‚Â¢ÃƒÆ’Ã†â€™Ãƒâ€ Ã¢â‚¬â„¢ÃƒÆ’Ã¢â‚¬Â ÃƒÂ¢Ã¢â€šÂ¬Ã¢â€žÂ¢ÃƒÆ’Ã†â€™ÃƒÂ¢Ã¢â€šÂ¬Ã‚Â ÃƒÆ’Ã‚Â¢ÃƒÂ¢Ã¢â‚¬Å¡Ã‚Â¬ÃƒÂ¢Ã¢â‚¬Å¾Ã‚Â¢ÃƒÆ’Ã†â€™Ãƒâ€ Ã¢â‚¬â„¢ÃƒÆ’Ã¢â‚¬Å¡Ãƒâ€šÃ‚Â¢ÃƒÆ’Ã†â€™Ãƒâ€šÃ‚Â¢ÃƒÆ’Ã‚Â¢ÃƒÂ¢Ã¢â‚¬Å¡Ã‚Â¬Ãƒâ€¦Ã‚Â¡ÃƒÆ’Ã¢â‚¬Å¡Ãƒâ€šÃ‚Â¬ÃƒÆ’Ã†â€™ÃƒÂ¢Ã¢â€šÂ¬Ã‚Â¦ÃƒÆ’Ã¢â‚¬Å¡Ãƒâ€šÃ‚Â¡ÃƒÆ’Ã†â€™Ãƒâ€ Ã¢â‚¬â„¢ÃƒÆ’Ã¢â‚¬Â ÃƒÂ¢Ã¢â€šÂ¬Ã¢â€žÂ¢ÃƒÆ’Ã†â€™Ãƒâ€šÃ‚Â¢ÃƒÆ’Ã‚Â¢ÃƒÂ¢Ã¢â€šÂ¬Ã…Â¡Ãƒâ€šÃ‚Â¬ÃƒÆ’Ã¢â‚¬Â¦Ãƒâ€šÃ‚Â¡ÃƒÆ’Ã†â€™Ãƒâ€ Ã¢â‚¬â„¢ÃƒÆ’Ã‚Â¢ÃƒÂ¢Ã¢â‚¬Å¡Ã‚Â¬Ãƒâ€¦Ã‚Â¡ÃƒÆ’Ã†â€™ÃƒÂ¢Ã¢â€šÂ¬Ã…Â¡ÃƒÆ’Ã¢â‚¬Å¡Ãƒâ€šÃ‚Â¢ÃƒÆ’Ã†â€™Ãƒâ€ Ã¢â‚¬â„¢ÃƒÆ’Ã¢â‚¬Â ÃƒÂ¢Ã¢â€šÂ¬Ã¢â€žÂ¢ÃƒÆ’Ã†â€™ÃƒÂ¢Ã¢â€šÂ¬Ã‚Â ÃƒÆ’Ã‚Â¢ÃƒÂ¢Ã¢â‚¬Å¡Ã‚Â¬ÃƒÂ¢Ã¢â‚¬Å¾Ã‚Â¢ÃƒÆ’Ã†â€™Ãƒâ€ Ã¢â‚¬â„¢ÃƒÆ’Ã‚Â¢ÃƒÂ¢Ã¢â‚¬Å¡Ã‚Â¬Ãƒâ€šÃ‚Â ÃƒÆ’Ã†â€™Ãƒâ€šÃ‚Â¢ÃƒÆ’Ã‚Â¢ÃƒÂ¢Ã¢â€šÂ¬Ã…Â¡Ãƒâ€šÃ‚Â¬ÃƒÆ’Ã‚Â¢ÃƒÂ¢Ã¢â€šÂ¬Ã…Â¾Ãƒâ€šÃ‚Â¢ÃƒÆ’Ã†â€™Ãƒâ€ Ã¢â‚¬â„¢ÃƒÆ’Ã¢â‚¬Â ÃƒÂ¢Ã¢â€šÂ¬Ã¢â€žÂ¢ÃƒÆ’Ã†â€™Ãƒâ€šÃ‚Â¢ÃƒÆ’Ã‚Â¢ÃƒÂ¢Ã¢â€šÂ¬Ã…Â¡Ãƒâ€šÃ‚Â¬ÃƒÆ’Ã¢â‚¬Â¦Ãƒâ€šÃ‚Â¡ÃƒÆ’Ã†â€™Ãƒâ€ Ã¢â‚¬â„¢ÃƒÆ’Ã‚Â¢ÃƒÂ¢Ã¢â‚¬Å¡Ã‚Â¬Ãƒâ€¦Ã‚Â¡ÃƒÆ’Ã†â€™ÃƒÂ¢Ã¢â€šÂ¬Ã…Â¡ÃƒÆ’Ã¢â‚¬Å¡Ãƒâ€šÃ‚Â¢ÃƒÆ’Ã†â€™Ãƒâ€ Ã¢â‚¬â„¢ÃƒÆ’Ã¢â‚¬Â ÃƒÂ¢Ã¢â€šÂ¬Ã¢â€žÂ¢ÃƒÆ’Ã†â€™ÃƒÂ¢Ã¢â€šÂ¬Ã‚Â ÃƒÆ’Ã‚Â¢ÃƒÂ¢Ã¢â‚¬Å¡Ã‚Â¬ÃƒÂ¢Ã¢â‚¬Å¾Ã‚Â¢ÃƒÆ’Ã†â€™Ãƒâ€ Ã¢â‚¬â„¢ÃƒÆ’Ã‚Â¢ÃƒÂ¢Ã¢â‚¬Å¡Ã‚Â¬Ãƒâ€¦Ã‚Â¡ÃƒÆ’Ã†â€™ÃƒÂ¢Ã¢â€šÂ¬Ã…Â¡ÃƒÆ’Ã¢â‚¬Å¡Ãƒâ€šÃ‚Â¢ÃƒÆ’Ã†â€™Ãƒâ€ Ã¢â‚¬â„¢ÃƒÆ’Ã¢â‚¬Â ÃƒÂ¢Ã¢â€šÂ¬Ã¢â€žÂ¢ÃƒÆ’Ã†â€™ÃƒÂ¢Ã¢â€šÂ¬Ã…Â¡ÃƒÆ’Ã¢â‚¬Å¡Ãƒâ€šÃ‚Â¢ÃƒÆ’Ã†â€™Ãƒâ€ Ã¢â‚¬â„¢ÃƒÆ’Ã¢â‚¬Å¡Ãƒâ€šÃ‚Â¢ÃƒÆ’Ã†â€™Ãƒâ€šÃ‚Â¢ÃƒÆ’Ã‚Â¢ÃƒÂ¢Ã¢â‚¬Å¡Ã‚Â¬Ãƒâ€¦Ã‚Â¡ÃƒÆ’Ã¢â‚¬Å¡Ãƒâ€šÃ‚Â¬ÃƒÆ’Ã†â€™ÃƒÂ¢Ã¢â€šÂ¬Ã‚Â¦ÃƒÆ’Ã¢â‚¬Å¡Ãƒâ€šÃ‚Â¡ÃƒÆ’Ã†â€™Ãƒâ€ Ã¢â‚¬â„¢ÃƒÆ’Ã‚Â¢ÃƒÂ¢Ã¢â‚¬Å¡Ã‚Â¬Ãƒâ€¦Ã‚Â¡ÃƒÆ’Ã†â€™ÃƒÂ¢Ã¢â€šÂ¬Ã…Â¡ÃƒÆ’Ã¢â‚¬Å¡Ãƒâ€šÃ‚Â¬ÃƒÆ’Ã†â€™Ãƒâ€ Ã¢â‚¬â„¢ÃƒÆ’Ã¢â‚¬Â ÃƒÂ¢Ã¢â€šÂ¬Ã¢â€žÂ¢ÃƒÆ’Ã†â€™Ãƒâ€šÃ‚Â¢ÃƒÆ’Ã‚Â¢ÃƒÂ¢Ã¢â€šÂ¬Ã…Â¡Ãƒâ€šÃ‚Â¬ÃƒÆ’Ã¢â‚¬Å¡Ãƒâ€šÃ‚Â¦ÃƒÆ’Ã†â€™Ãƒâ€ Ã¢â‚¬â„¢ÃƒÆ’Ã‚Â¢ÃƒÂ¢Ã¢â‚¬Å¡Ã‚Â¬Ãƒâ€¦Ã‚Â¡ÃƒÆ’Ã†â€™ÃƒÂ¢Ã¢â€šÂ¬Ã…Â¡ÃƒÆ’Ã¢â‚¬Å¡Ãƒâ€šÃ‚Â¡ÃƒÆ’Ã†â€™Ãƒâ€ Ã¢â‚¬â„¢ÃƒÆ’Ã¢â‚¬Â ÃƒÂ¢Ã¢â€šÂ¬Ã¢â€žÂ¢ÃƒÆ’Ã†â€™ÃƒÂ¢Ã¢â€šÂ¬Ã‚Â ÃƒÆ’Ã‚Â¢ÃƒÂ¢Ã¢â‚¬Å¡Ã‚Â¬ÃƒÂ¢Ã¢â‚¬Å¾Ã‚Â¢ÃƒÆ’Ã†â€™Ãƒâ€ Ã¢â‚¬â„¢ÃƒÆ’Ã¢â‚¬Å¡Ãƒâ€šÃ‚Â¢ÃƒÆ’Ã†â€™Ãƒâ€šÃ‚Â¢ÃƒÆ’Ã‚Â¢ÃƒÂ¢Ã¢â‚¬Å¡Ã‚Â¬Ãƒâ€¦Ã‚Â¡ÃƒÆ’Ã¢â‚¬Å¡Ãƒâ€šÃ‚Â¬ÃƒÆ’Ã†â€™ÃƒÂ¢Ã¢â€šÂ¬Ã‚Â¦ÃƒÆ’Ã¢â‚¬Å¡Ãƒâ€šÃ‚Â¡ÃƒÆ’Ã†â€™Ãƒâ€ Ã¢â‚¬â„¢ÃƒÆ’Ã¢â‚¬Â ÃƒÂ¢Ã¢â€šÂ¬Ã¢â€žÂ¢ÃƒÆ’Ã†â€™Ãƒâ€šÃ‚Â¢ÃƒÆ’Ã‚Â¢ÃƒÂ¢Ã¢â€šÂ¬Ã…Â¡Ãƒâ€šÃ‚Â¬ÃƒÆ’Ã¢â‚¬Â¦Ãƒâ€šÃ‚Â¡ÃƒÆ’Ã†â€™Ãƒâ€ Ã¢â‚¬â„¢ÃƒÆ’Ã‚Â¢ÃƒÂ¢Ã¢â‚¬Å¡Ã‚Â¬Ãƒâ€¦Ã‚Â¡ÃƒÆ’Ã†â€™ÃƒÂ¢Ã¢â€šÂ¬Ã…Â¡ÃƒÆ’Ã¢â‚¬Å¡Ãƒâ€šÃ‚Â¬ÃƒÆ’Ã†â€™Ãƒâ€ Ã¢â‚¬â„¢ÃƒÆ’Ã¢â‚¬Â ÃƒÂ¢Ã¢â€šÂ¬Ã¢â€žÂ¢ÃƒÆ’Ã†â€™ÃƒÂ¢Ã¢â€šÂ¬Ã‚Â ÃƒÆ’Ã‚Â¢ÃƒÂ¢Ã¢â‚¬Å¡Ã‚Â¬ÃƒÂ¢Ã¢â‚¬Å¾Ã‚Â¢ÃƒÆ’Ã†â€™Ãƒâ€ Ã¢â‚¬â„¢ÃƒÆ’Ã‚Â¢ÃƒÂ¢Ã¢â‚¬Å¡Ã‚Â¬Ãƒâ€šÃ‚Â ÃƒÆ’Ã†â€™Ãƒâ€šÃ‚Â¢ÃƒÆ’Ã‚Â¢ÃƒÂ¢Ã¢â€šÂ¬Ã…Â¡Ãƒâ€šÃ‚Â¬ÃƒÆ’Ã‚Â¢ÃƒÂ¢Ã¢â€šÂ¬Ã…Â¾Ãƒâ€šÃ‚Â¢ÃƒÆ’Ã†â€™Ãƒâ€ Ã¢â‚¬â„¢ÃƒÆ’Ã¢â‚¬Â ÃƒÂ¢Ã¢â€šÂ¬Ã¢â€žÂ¢ÃƒÆ’Ã†â€™Ãƒâ€šÃ‚Â¢ÃƒÆ’Ã‚Â¢ÃƒÂ¢Ã¢â€šÂ¬Ã…Â¡Ãƒâ€šÃ‚Â¬ÃƒÆ’Ã¢â‚¬Â¦Ãƒâ€šÃ‚Â¡ÃƒÆ’Ã†â€™Ãƒâ€ Ã¢â‚¬â„¢ÃƒÆ’Ã‚Â¢ÃƒÂ¢Ã¢â‚¬Å¡Ã‚Â¬Ãƒâ€¦Ã‚Â¡ÃƒÆ’Ã†â€™ÃƒÂ¢Ã¢â€šÂ¬Ã…Â¡ÃƒÆ’Ã¢â‚¬Å¡Ãƒâ€šÃ‚Â¢ÃƒÆ’Ã†â€™Ãƒâ€ Ã¢â‚¬â„¢ÃƒÆ’Ã¢â‚¬Â ÃƒÂ¢Ã¢â€šÂ¬Ã¢â€žÂ¢ÃƒÆ’Ã†â€™ÃƒÂ¢Ã¢â€šÂ¬Ã‚Â ÃƒÆ’Ã‚Â¢ÃƒÂ¢Ã¢â‚¬Å¡Ã‚Â¬ÃƒÂ¢Ã¢â‚¬Å¾Ã‚Â¢ÃƒÆ’Ã†â€™Ãƒâ€ Ã¢â‚¬â„¢ÃƒÆ’Ã‚Â¢ÃƒÂ¢Ã¢â‚¬Å¡Ã‚Â¬Ãƒâ€¦Ã‚Â¡ÃƒÆ’Ã†â€™ÃƒÂ¢Ã¢â€šÂ¬Ã…Â¡ÃƒÆ’Ã¢â‚¬Å¡Ãƒâ€šÃ‚Â¢ÃƒÆ’Ã†â€™Ãƒâ€ Ã¢â‚¬â„¢ÃƒÆ’Ã¢â‚¬Â ÃƒÂ¢Ã¢â€šÂ¬Ã¢â€žÂ¢ÃƒÆ’Ã†â€™ÃƒÂ¢Ã¢â€šÂ¬Ã…Â¡ÃƒÆ’Ã¢â‚¬Å¡Ãƒâ€šÃ‚Â¢ÃƒÆ’Ã†â€™Ãƒâ€ Ã¢â‚¬â„¢ÃƒÆ’Ã¢â‚¬Å¡Ãƒâ€šÃ‚Â¢ÃƒÆ’Ã†â€™Ãƒâ€šÃ‚Â¢ÃƒÆ’Ã‚Â¢ÃƒÂ¢Ã¢â€šÂ¬Ã…Â¡Ãƒâ€šÃ‚Â¬ÃƒÆ’Ã¢â‚¬Â¦Ãƒâ€šÃ‚Â¡ÃƒÆ’Ã†â€™ÃƒÂ¢Ã¢â€šÂ¬Ã…Â¡ÃƒÆ’Ã¢â‚¬Å¡Ãƒâ€šÃ‚Â¬ÃƒÆ’Ã†â€™Ãƒâ€ Ã¢â‚¬â„¢ÃƒÆ’Ã‚Â¢ÃƒÂ¢Ã¢â‚¬Å¡Ã‚Â¬Ãƒâ€šÃ‚Â¦ÃƒÆ’Ã†â€™ÃƒÂ¢Ã¢â€šÂ¬Ã…Â¡ÃƒÆ’Ã¢â‚¬Å¡Ãƒâ€šÃ‚Â¡ÃƒÆ’Ã†â€™Ãƒâ€ Ã¢â‚¬â„¢ÃƒÆ’Ã¢â‚¬Â ÃƒÂ¢Ã¢â€šÂ¬Ã¢â€žÂ¢ÃƒÆ’Ã†â€™Ãƒâ€šÃ‚Â¢ÃƒÆ’Ã‚Â¢ÃƒÂ¢Ã¢â€šÂ¬Ã…Â¡Ãƒâ€šÃ‚Â¬ÃƒÆ’Ã¢â‚¬Â¦Ãƒâ€šÃ‚Â¡ÃƒÆ’Ã†â€™Ãƒâ€ Ã¢â‚¬â„¢ÃƒÆ’Ã‚Â¢ÃƒÂ¢Ã¢â‚¬Å¡Ã‚Â¬Ãƒâ€¦Ã‚Â¡ÃƒÆ’Ã†â€™ÃƒÂ¢Ã¢â€šÂ¬Ã…Â¡ÃƒÆ’Ã¢â‚¬Å¡Ãƒâ€šÃ‚Â¬ÃƒÆ’Ã†â€™Ãƒâ€ Ã¢â‚¬â„¢ÃƒÆ’Ã¢â‚¬Â ÃƒÂ¢Ã¢â€šÂ¬Ã¢â€žÂ¢ÃƒÆ’Ã†â€™ÃƒÂ¢Ã¢â€šÂ¬Ã‚Â ÃƒÆ’Ã‚Â¢ÃƒÂ¢Ã¢â‚¬Å¡Ã‚Â¬ÃƒÂ¢Ã¢â‚¬Å¾Ã‚Â¢ÃƒÆ’Ã†â€™Ãƒâ€ Ã¢â‚¬â„¢ÃƒÆ’Ã¢â‚¬Å¡Ãƒâ€šÃ‚Â¢ÃƒÆ’Ã†â€™Ãƒâ€šÃ‚Â¢ÃƒÆ’Ã‚Â¢ÃƒÂ¢Ã¢â‚¬Å¡Ã‚Â¬Ãƒâ€¦Ã‚Â¡ÃƒÆ’Ã¢â‚¬Å¡Ãƒâ€šÃ‚Â¬ÃƒÆ’Ã†â€™ÃƒÂ¢Ã¢â€šÂ¬Ã…Â¡ÃƒÆ’Ã¢â‚¬Å¡Ãƒâ€šÃ‚Â¦ÃƒÆ’Ã†â€™Ãƒâ€ Ã¢â‚¬â„¢ÃƒÆ’Ã¢â‚¬Â ÃƒÂ¢Ã¢â€šÂ¬Ã¢â€žÂ¢ÃƒÆ’Ã†â€™ÃƒÂ¢Ã¢â€šÂ¬Ã…Â¡ÃƒÆ’Ã¢â‚¬Å¡Ãƒâ€šÃ‚Â¢ÃƒÆ’Ã†â€™Ãƒâ€ Ã¢â‚¬â„¢ÃƒÆ’Ã¢â‚¬Å¡Ãƒâ€šÃ‚Â¢ÃƒÆ’Ã†â€™Ãƒâ€šÃ‚Â¢ÃƒÆ’Ã‚Â¢ÃƒÂ¢Ã¢â€šÂ¬Ã…Â¡Ãƒâ€šÃ‚Â¬ÃƒÆ’Ã¢â‚¬Â¦Ãƒâ€šÃ‚Â¡ÃƒÆ’Ã†â€™ÃƒÂ¢Ã¢â€šÂ¬Ã…Â¡ÃƒÆ’Ã¢â‚¬Å¡Ãƒâ€šÃ‚Â¬ÃƒÆ’Ã†â€™Ãƒâ€ Ã¢â‚¬â„¢ÃƒÆ’Ã‚Â¢ÃƒÂ¢Ã¢â‚¬Å¡Ã‚Â¬Ãƒâ€šÃ‚Â¦ÃƒÆ’Ã†â€™Ãƒâ€šÃ‚Â¢ÃƒÆ’Ã‚Â¢ÃƒÂ¢Ã¢â€šÂ¬Ã…Â¡Ãƒâ€šÃ‚Â¬ÃƒÆ’Ã¢â‚¬Â¦ÃƒÂ¢Ã¢â€šÂ¬Ã…â€œWk4), both systems recovered strongly, with Monoculture showing a slightly higher growth rate (3.227%/day) than IMTA (2.958%/day).</w:t>
-      </w:r>
-    </w:p>
-    <w:p>
-      <w:pPr>
-        <w:spacing w:line="360" w:lineRule="auto"/>
-        <w:rPr>
-          <w:rFonts w:ascii="Times New Roman" w:hAnsi="Times New Roman" w:cs="Times New Roman"/>
-        </w:rPr>
-      </w:pPr>
-      <w:r>
-        <w:rPr>
-          <w:rFonts w:ascii="Times New Roman" w:hAnsi="Times New Roman" w:cs="Times New Roman"/>
-        </w:rPr>
-        <w:t xml:space="preserve">A clear difference in stability is observed during the Wk4ÃƒÆ’Ã†â€™Ãƒâ€ Ã¢â‚¬â„¢ÃƒÆ’Ã¢â‚¬Â ÃƒÂ¢Ã¢â€šÂ¬Ã¢â€žÂ¢ÃƒÆ’Ã†â€™ÃƒÂ¢Ã¢â€šÂ¬Ã‚Â ÃƒÆ’Ã‚Â¢ÃƒÂ¢Ã¢â‚¬Å¡Ã‚Â¬ÃƒÂ¢Ã¢â‚¬Å¾Ã‚Â¢ÃƒÆ’Ã†â€™Ãƒâ€ Ã¢â‚¬â„¢ÃƒÆ’Ã‚Â¢ÃƒÂ¢Ã¢â‚¬Å¡Ã‚Â¬Ãƒâ€šÃ‚Â ÃƒÆ’Ã†â€™Ãƒâ€šÃ‚Â¢ÃƒÆ’Ã‚Â¢ÃƒÂ¢Ã¢â€šÂ¬Ã…Â¡Ãƒâ€šÃ‚Â¬ÃƒÆ’Ã‚Â¢ÃƒÂ¢Ã¢â€šÂ¬Ã…Â¾Ãƒâ€šÃ‚Â¢ÃƒÆ’Ã†â€™Ãƒâ€ Ã¢â‚¬â„¢ÃƒÆ’Ã¢â‚¬Â ÃƒÂ¢Ã¢â€šÂ¬Ã¢â€žÂ¢ÃƒÆ’Ã†â€™Ãƒâ€šÃ‚Â¢ÃƒÆ’Ã‚Â¢ÃƒÂ¢Ã¢â€šÂ¬Ã…Â¡Ãƒâ€šÃ‚Â¬ÃƒÆ’Ã¢â‚¬Å¡Ãƒâ€šÃ‚Â ÃƒÆ’Ã†â€™Ãƒâ€ Ã¢â‚¬â„¢ÃƒÆ’Ã¢â‚¬Å¡Ãƒâ€šÃ‚Â¢ÃƒÆ’Ã†â€™Ãƒâ€šÃ‚Â¢ÃƒÆ’Ã‚Â¢ÃƒÂ¢Ã¢â‚¬Å¡Ã‚Â¬Ãƒâ€¦Ã‚Â¡ÃƒÆ’Ã¢â‚¬Å¡Ãƒâ€šÃ‚Â¬ÃƒÆ’Ã†â€™Ãƒâ€šÃ‚Â¢ÃƒÆ’Ã‚Â¢ÃƒÂ¢Ã¢â‚¬Å¡Ã‚Â¬Ãƒâ€¦Ã‚Â¾ÃƒÆ’Ã¢â‚¬Å¡Ãƒâ€šÃ‚Â¢ÃƒÆ’Ã†â€™Ãƒâ€ Ã¢â‚¬â„¢ÃƒÆ’Ã¢â‚¬Â ÃƒÂ¢Ã¢â€šÂ¬Ã¢â€žÂ¢ÃƒÆ’Ã†â€™ÃƒÂ¢Ã¢â€šÂ¬Ã‚Â ÃƒÆ’Ã‚Â¢ÃƒÂ¢Ã¢â‚¬Å¡Ã‚Â¬ÃƒÂ¢Ã¢â‚¬Å¾Ã‚Â¢ÃƒÆ’Ã†â€™Ãƒâ€ Ã¢â‚¬â„¢ÃƒÆ’Ã¢â‚¬Å¡Ãƒâ€šÃ‚Â¢ÃƒÆ’Ã†â€™Ãƒâ€šÃ‚Â¢ÃƒÆ’Ã‚Â¢ÃƒÂ¢Ã¢â‚¬Å¡Ã‚Â¬Ãƒâ€¦Ã‚Â¡ÃƒÆ’Ã¢â‚¬Å¡Ãƒâ€šÃ‚Â¬ÃƒÆ’Ã†â€™ÃƒÂ¢Ã¢â€šÂ¬Ã‚Â¦ÃƒÆ’Ã¢â‚¬Å¡Ãƒâ€šÃ‚Â¡ÃƒÆ’Ã†â€™Ãƒâ€ Ã¢â‚¬â„¢ÃƒÆ’Ã¢â‚¬Â ÃƒÂ¢Ã¢â€šÂ¬Ã¢â€žÂ¢ÃƒÆ’Ã†â€™Ãƒâ€šÃ‚Â¢ÃƒÆ’Ã‚Â¢ÃƒÂ¢Ã¢â€šÂ¬Ã…Â¡Ãƒâ€šÃ‚Â¬ÃƒÆ’Ã¢â‚¬Â¦Ãƒâ€šÃ‚Â¡ÃƒÆ’Ã†â€™Ãƒâ€ Ã¢â‚¬â„¢ÃƒÆ’Ã‚Â¢ÃƒÂ¢Ã¢â‚¬Å¡Ã‚Â¬Ãƒâ€¦Ã‚Â¡ÃƒÆ’Ã†â€™ÃƒÂ¢Ã¢â€šÂ¬Ã…Â¡ÃƒÆ’Ã¢â‚¬Å¡Ãƒâ€šÃ‚Â¢ÃƒÆ’Ã†â€™Ãƒâ€ Ã¢â‚¬â„¢ÃƒÆ’Ã¢â‚¬Â ÃƒÂ¢Ã¢â€šÂ¬Ã¢â€žÂ¢ÃƒÆ’Ã†â€™ÃƒÂ¢Ã¢â€šÂ¬Ã‚Â ÃƒÆ’Ã‚Â¢ÃƒÂ¢Ã¢â‚¬Å¡Ã‚Â¬ÃƒÂ¢Ã¢â‚¬Å¾Ã‚Â¢ÃƒÆ’Ã†â€™Ãƒâ€ Ã¢â‚¬â„¢ÃƒÆ’Ã‚Â¢ÃƒÂ¢Ã¢â‚¬Å¡Ã‚Â¬Ãƒâ€šÃ‚Â ÃƒÆ’Ã†â€™Ãƒâ€šÃ‚Â¢ÃƒÆ’Ã‚Â¢ÃƒÂ¢Ã¢â€šÂ¬Ã…Â¡Ãƒâ€šÃ‚Â¬ÃƒÆ’Ã‚Â¢ÃƒÂ¢Ã¢â€šÂ¬Ã…Â¾Ãƒâ€šÃ‚Â¢ÃƒÆ’Ã†â€™Ãƒâ€ Ã¢â‚¬â„¢ÃƒÆ’Ã¢â‚¬Â ÃƒÂ¢Ã¢â€šÂ¬Ã¢â€žÂ¢ÃƒÆ’Ã†â€™Ãƒâ€šÃ‚Â¢ÃƒÆ’Ã‚Â¢ÃƒÂ¢Ã¢â€šÂ¬Ã…Â¡Ãƒâ€šÃ‚Â¬ÃƒÆ’Ã¢â‚¬Â¦Ãƒâ€šÃ‚Â¡ÃƒÆ’Ã†â€™Ãƒâ€ Ã¢â‚¬â„¢ÃƒÆ’Ã‚Â¢ÃƒÂ¢Ã¢â‚¬Å¡Ã‚Â¬Ãƒâ€¦Ã‚Â¡ÃƒÆ’Ã†â€™ÃƒÂ¢Ã¢â€šÂ¬Ã…Â¡ÃƒÆ’Ã¢â‚¬Å¡Ãƒâ€šÃ‚Â¢ÃƒÆ’Ã†â€™Ãƒâ€ Ã¢â‚¬â„¢ÃƒÆ’Ã¢â‚¬Â ÃƒÂ¢Ã¢â€šÂ¬Ã¢â€žÂ¢ÃƒÆ’Ã†â€™ÃƒÂ¢Ã¢â€šÂ¬Ã‚Â ÃƒÆ’Ã‚Â¢ÃƒÂ¢Ã¢â‚¬Å¡Ã‚Â¬ÃƒÂ¢Ã¢â‚¬Å¾Ã‚Â¢ÃƒÆ’Ã†â€™Ãƒâ€ Ã¢â‚¬â„¢ÃƒÆ’Ã‚Â¢ÃƒÂ¢Ã¢â‚¬Å¡Ã‚Â¬Ãƒâ€¦Ã‚Â¡ÃƒÆ’Ã†â€™ÃƒÂ¢Ã¢â€šÂ¬Ã…Â¡ÃƒÆ’Ã¢â‚¬Å¡Ãƒâ€šÃ‚Â¢ÃƒÆ’Ã†â€™Ãƒâ€ Ã¢â‚¬â„¢ÃƒÆ’Ã¢â‚¬Â ÃƒÂ¢Ã¢â€šÂ¬Ã¢â€žÂ¢ÃƒÆ’Ã†â€™ÃƒÂ¢Ã¢â€šÂ¬Ã…Â¡ÃƒÆ’Ã¢â‚¬Å¡Ãƒâ€šÃ‚Â¢ÃƒÆ’Ã†â€™Ãƒâ€ Ã¢â‚¬â„¢ÃƒÆ’Ã¢â‚¬Å¡Ãƒâ€šÃ‚Â¢ÃƒÆ’Ã†â€™Ãƒâ€šÃ‚Â¢ÃƒÆ’Ã‚Â¢ÃƒÂ¢Ã¢â‚¬Å¡Ã‚Â¬Ãƒâ€¦Ã‚Â¡ÃƒÆ’Ã¢â‚¬Å¡Ãƒâ€šÃ‚Â¬ÃƒÆ’Ã†â€™ÃƒÂ¢Ã¢â€šÂ¬Ã‚Â¦ÃƒÆ’Ã¢â‚¬Å¡Ãƒâ€šÃ‚Â¡ÃƒÆ’Ã†â€™Ãƒâ€ Ã¢â‚¬â„¢ÃƒÆ’Ã‚Â¢ÃƒÂ¢Ã¢â‚¬Å¡Ã‚Â¬Ãƒâ€¦Ã‚Â¡ÃƒÆ’Ã†â€™ÃƒÂ¢Ã¢â€šÂ¬Ã…Â¡ÃƒÆ’Ã¢â‚¬Å¡Ãƒâ€šÃ‚Â¬ÃƒÆ’Ã†â€™Ãƒâ€ Ã¢â‚¬â„¢ÃƒÆ’Ã¢â‚¬Â ÃƒÂ¢Ã¢â€šÂ¬Ã¢â€žÂ¢ÃƒÆ’Ã†â€™Ãƒâ€šÃ‚Â¢ÃƒÆ’Ã‚Â¢ÃƒÂ¢Ã¢â€šÂ¬Ã…Â¡Ãƒâ€šÃ‚Â¬ÃƒÆ’Ã¢â‚¬Å¡Ãƒâ€šÃ‚Â¦ÃƒÆ’Ã†â€™Ãƒâ€ Ã¢â‚¬â„¢ÃƒÆ’Ã‚Â¢ÃƒÂ¢Ã¢â‚¬Å¡Ã‚Â¬Ãƒâ€¦Ã‚Â¡ÃƒÆ’Ã†â€™ÃƒÂ¢Ã¢â€šÂ¬Ã…Â¡ÃƒÆ’Ã¢â‚¬Å¡Ãƒâ€šÃ‚Â¡ÃƒÆ’Ã†â€™Ãƒâ€ Ã¢â‚¬â„¢ÃƒÆ’Ã¢â‚¬Â ÃƒÂ¢Ã¢â€šÂ¬Ã¢â€žÂ¢ÃƒÆ’Ã†â€™ÃƒÂ¢Ã¢â€šÂ¬Ã‚Â ÃƒÆ’Ã‚Â¢ÃƒÂ¢Ã¢â‚¬Å¡Ã‚Â¬ÃƒÂ¢Ã¢â‚¬Å¾Ã‚Â¢ÃƒÆ’Ã†â€™Ãƒâ€ Ã¢â‚¬â„¢ÃƒÆ’Ã¢â‚¬Å¡Ãƒâ€šÃ‚Â¢ÃƒÆ’Ã†â€™Ãƒâ€šÃ‚Â¢ÃƒÆ’Ã‚Â¢ÃƒÂ¢Ã¢â‚¬Å¡Ã‚Â¬Ãƒâ€¦Ã‚Â¡ÃƒÆ’Ã¢â‚¬Å¡Ãƒâ€šÃ‚Â¬ÃƒÆ’Ã†â€™ÃƒÂ¢Ã¢â€šÂ¬Ã‚Â¦ÃƒÆ’Ã¢â‚¬Å¡Ãƒâ€šÃ‚Â¡ÃƒÆ’Ã†â€™Ãƒâ€ Ã¢â‚¬â„¢ÃƒÆ’Ã¢â‚¬Â ÃƒÂ¢Ã¢â€šÂ¬Ã¢â€žÂ¢ÃƒÆ’Ã†â€™Ãƒâ€šÃ‚Â¢ÃƒÆ’Ã‚Â¢ÃƒÂ¢Ã¢â€šÂ¬Ã…Â¡Ãƒâ€šÃ‚Â¬ÃƒÆ’Ã¢â‚¬Â¦Ãƒâ€šÃ‚Â¡ÃƒÆ’Ã†â€™Ãƒâ€ Ã¢â‚¬â„¢ÃƒÆ’Ã‚Â¢ÃƒÂ¢Ã¢â‚¬Å¡Ã‚Â¬Ãƒâ€¦Ã‚Â¡ÃƒÆ’Ã†â€™ÃƒÂ¢Ã¢â€šÂ¬Ã…Â¡ÃƒÆ’Ã¢â‚¬Å¡Ãƒâ€šÃ‚Â¬ÃƒÆ’Ã†â€™Ãƒâ€ Ã¢â‚¬â„¢ÃƒÆ’Ã¢â‚¬Â ÃƒÂ¢Ã¢â€šÂ¬Ã¢â€žÂ¢ÃƒÆ’Ã†â€™ÃƒÂ¢Ã¢â€šÂ¬Ã‚Â ÃƒÆ’Ã‚Â¢ÃƒÂ¢Ã¢â‚¬Å¡Ã‚Â¬ÃƒÂ¢Ã¢â‚¬Å¾Ã‚Â¢ÃƒÆ’Ã†â€™Ãƒâ€ Ã¢â‚¬â„¢ÃƒÆ’Ã‚Â¢ÃƒÂ¢Ã¢â‚¬Å¡Ã‚Â¬Ãƒâ€šÃ‚Â ÃƒÆ’Ã†â€™Ãƒâ€šÃ‚Â¢ÃƒÆ’Ã‚Â¢ÃƒÂ¢Ã¢â€šÂ¬Ã…Â¡Ãƒâ€šÃ‚Â¬ÃƒÆ’Ã‚Â¢ÃƒÂ¢Ã¢â€šÂ¬Ã…Â¾Ãƒâ€šÃ‚Â¢ÃƒÆ’Ã†â€™Ãƒâ€ Ã¢â‚¬â„¢ÃƒÆ’Ã¢â‚¬Â ÃƒÂ¢Ã¢â€šÂ¬Ã¢â€žÂ¢ÃƒÆ’Ã†â€™Ãƒâ€šÃ‚Â¢ÃƒÆ’Ã‚Â¢ÃƒÂ¢Ã¢â€šÂ¬Ã…Â¡Ãƒâ€šÃ‚Â¬ÃƒÆ’Ã¢â‚¬Â¦Ãƒâ€šÃ‚Â¡ÃƒÆ’Ã†â€™Ãƒâ€ Ã¢â‚¬â„¢ÃƒÆ’Ã‚Â¢ÃƒÂ¢Ã¢â‚¬Å¡Ã‚Â¬Ãƒâ€¦Ã‚Â¡ÃƒÆ’Ã†â€™ÃƒÂ¢Ã¢â€šÂ¬Ã…Â¡ÃƒÆ’Ã¢â‚¬Å¡Ãƒâ€šÃ‚Â¢ÃƒÆ’Ã†â€™Ãƒâ€ Ã¢â‚¬â„¢ÃƒÆ’Ã¢â‚¬Â ÃƒÂ¢Ã¢â€šÂ¬Ã¢â€žÂ¢ÃƒÆ’Ã†â€™ÃƒÂ¢Ã¢â€šÂ¬Ã‚Â ÃƒÆ’Ã‚Â¢ÃƒÂ¢Ã¢â‚¬Å¡Ã‚Â¬ÃƒÂ¢Ã¢â‚¬Å¾Ã‚Â¢ÃƒÆ’Ã†â€™Ãƒâ€ Ã¢â‚¬â„¢ÃƒÆ’Ã‚Â¢ÃƒÂ¢Ã¢â‚¬Å¡Ã‚Â¬Ãƒâ€¦Ã‚Â¡ÃƒÆ’Ã†â€™ÃƒÂ¢Ã¢â€šÂ¬Ã…Â¡ÃƒÆ’Ã¢â‚¬Å¡Ãƒâ€šÃ‚Â¢ÃƒÆ’Ã†â€™Ãƒâ€ Ã¢â‚¬â„¢ÃƒÆ’Ã¢â‚¬Â ÃƒÂ¢Ã¢â€šÂ¬Ã¢â€žÂ¢ÃƒÆ’Ã†â€™ÃƒÂ¢Ã¢â€šÂ¬Ã…Â¡ÃƒÆ’Ã¢â‚¬Å¡Ãƒâ€šÃ‚Â¢ÃƒÆ’Ã†â€™Ãƒâ€ Ã¢â‚¬â„¢ÃƒÆ’Ã¢â‚¬Å¡Ãƒâ€šÃ‚Â¢ÃƒÆ’Ã†â€™Ãƒâ€šÃ‚Â¢ÃƒÆ’Ã‚Â¢ÃƒÂ¢Ã¢â€šÂ¬Ã…Â¡Ãƒâ€šÃ‚Â¬ÃƒÆ’Ã¢â‚¬Â¦Ãƒâ€šÃ‚Â¡ÃƒÆ’Ã†â€™ÃƒÂ¢Ã¢â€šÂ¬Ã…Â¡ÃƒÆ’Ã¢â‚¬Å¡Ãƒâ€šÃ‚Â¬ÃƒÆ’Ã†â€™Ãƒâ€ Ã¢â‚¬â„¢ÃƒÆ’Ã‚Â¢ÃƒÂ¢Ã¢â‚¬Å¡Ã‚Â¬Ãƒâ€šÃ‚Â¦ÃƒÆ’Ã†â€™ÃƒÂ¢Ã¢â€šÂ¬Ã…Â¡ÃƒÆ’Ã¢â‚¬Å¡Ãƒâ€šÃ‚Â¡ÃƒÆ’Ã†â€™Ãƒâ€ Ã¢â‚¬â„¢ÃƒÆ’Ã¢â‚¬Â ÃƒÂ¢Ã¢â€šÂ¬Ã¢â€žÂ¢ÃƒÆ’Ã†â€™Ãƒâ€šÃ‚Â¢ÃƒÆ’Ã‚Â¢ÃƒÂ¢Ã¢â€šÂ¬Ã…Â¡Ãƒâ€šÃ‚Â¬ÃƒÆ’Ã¢â‚¬Â¦Ãƒâ€šÃ‚Â¡ÃƒÆ’Ã†â€™Ãƒâ€ Ã¢â‚¬â„¢ÃƒÆ’Ã‚Â¢ÃƒÂ¢Ã¢â‚¬Å¡Ã‚Â¬Ãƒâ€¦Ã‚Â¡ÃƒÆ’Ã†â€™ÃƒÂ¢Ã¢â€šÂ¬Ã…Â¡ÃƒÆ’Ã¢â‚¬Å¡Ãƒâ€šÃ‚Â¬ÃƒÆ’Ã†â€™Ãƒâ€ Ã¢â‚¬â„¢ÃƒÆ’Ã¢â‚¬Â ÃƒÂ¢Ã¢â€šÂ¬Ã¢â€žÂ¢ÃƒÆ’Ã†â€™ÃƒÂ¢Ã¢â€šÂ¬Ã‚Â ÃƒÆ’Ã‚Â¢ÃƒÂ¢Ã¢â‚¬Å¡Ã‚Â¬ÃƒÂ¢Ã¢â‚¬Å¾Ã‚Â¢ÃƒÆ’Ã†â€™Ãƒâ€ Ã¢â‚¬â„¢ÃƒÆ’Ã¢â‚¬Å¡Ãƒâ€šÃ‚Â¢ÃƒÆ’Ã†â€™Ãƒâ€šÃ‚Â¢ÃƒÆ’Ã‚Â¢ÃƒÂ¢Ã¢â‚¬Å¡Ã‚Â¬Ãƒâ€¦Ã‚Â¡ÃƒÆ’Ã¢â‚¬Å¡Ãƒâ€šÃ‚Â¬ÃƒÆ’Ã†â€™ÃƒÂ¢Ã¢â€šÂ¬Ã…Â¡ÃƒÆ’Ã¢â‚¬Å¡Ãƒâ€šÃ‚Â¦ÃƒÆ’Ã†â€™Ãƒâ€ Ã¢â‚¬â„¢ÃƒÆ’Ã¢â‚¬Â ÃƒÂ¢Ã¢â€šÂ¬Ã¢â€žÂ¢ÃƒÆ’Ã†â€™ÃƒÂ¢Ã¢â€šÂ¬Ã…Â¡ÃƒÆ’Ã¢â‚¬Å¡Ãƒâ€šÃ‚Â¢ÃƒÆ’Ã†â€™Ãƒâ€ Ã¢â‚¬â„¢ÃƒÆ’Ã¢â‚¬Å¡Ãƒâ€šÃ‚Â¢ÃƒÆ’Ã†â€™Ãƒâ€šÃ‚Â¢ÃƒÆ’Ã‚Â¢ÃƒÂ¢Ã¢â€šÂ¬Ã…Â¡Ãƒâ€šÃ‚Â¬ÃƒÆ’Ã¢â‚¬Â¦Ãƒâ€šÃ‚Â¡ÃƒÆ’Ã†â€™ÃƒÂ¢Ã¢â€šÂ¬Ã…Â¡ÃƒÆ’Ã¢â‚¬Å¡Ãƒâ€šÃ‚Â¬ÃƒÆ’Ã†â€™Ãƒâ€ Ã¢â‚¬â„¢ÃƒÆ’Ã‚Â¢ÃƒÂ¢Ã¢â‚¬Å¡Ã‚Â¬Ãƒâ€šÃ‚Â¦ÃƒÆ’Ã†â€™Ãƒâ€šÃ‚Â¢ÃƒÆ’Ã‚Â¢ÃƒÂ¢Ã¢â€šÂ¬Ã…Â¡Ãƒâ€šÃ‚Â¬ÃƒÆ’Ã¢â‚¬Â¦ÃƒÂ¢Ã¢â€šÂ¬Ã…â€œWk5 interval, where the IMTA system remained relatively stable with a minor decline (-0.668%/day), while the Monoculture system experienced a sharp drop in growth (-9.516%/day), indicating strong physiological stress. In the final phase (Wk5ÃƒÆ’Ã†â€™Ãƒâ€ Ã¢â‚¬â„¢ÃƒÆ’Ã¢â‚¬Â ÃƒÂ¢Ã¢â€šÂ¬Ã¢â€žÂ¢ÃƒÆ’Ã†â€™ÃƒÂ¢Ã¢â€šÂ¬Ã‚Â ÃƒÆ’Ã‚Â¢ÃƒÂ¢Ã¢â‚¬Å¡Ã‚Â¬ÃƒÂ¢Ã¢â‚¬Å¾Ã‚Â¢ÃƒÆ’Ã†â€™Ãƒâ€ Ã¢â‚¬â„¢ÃƒÆ’Ã‚Â¢ÃƒÂ¢Ã¢â‚¬Å¡Ã‚Â¬Ãƒâ€šÃ‚Â ÃƒÆ’Ã†â€™Ãƒâ€šÃ‚Â¢ÃƒÆ’Ã‚Â¢ÃƒÂ¢Ã¢â€šÂ¬Ã…Â¡Ãƒâ€šÃ‚Â¬ÃƒÆ’Ã‚Â¢ÃƒÂ¢Ã¢â€šÂ¬Ã…Â¾Ãƒâ€šÃ‚Â¢ÃƒÆ’Ã†â€™Ãƒâ€ Ã¢â‚¬â„¢ÃƒÆ’Ã¢â‚¬Â ÃƒÂ¢Ã¢â€šÂ¬Ã¢â€žÂ¢ÃƒÆ’Ã†â€™Ãƒâ€šÃ‚Â¢ÃƒÆ’Ã‚Â¢ÃƒÂ¢Ã¢â€šÂ¬Ã…Â¡Ãƒâ€šÃ‚Â¬ÃƒÆ’Ã¢â‚¬Å¡Ãƒâ€šÃ‚Â ÃƒÆ’Ã†â€™Ãƒâ€ Ã¢â‚¬â„¢ÃƒÆ’Ã¢â‚¬Å¡Ãƒâ€šÃ‚Â¢ÃƒÆ’Ã†â€™Ãƒâ€šÃ‚Â¢ÃƒÆ’Ã‚Â¢ÃƒÂ¢Ã¢â‚¬Å¡Ã‚Â¬Ãƒâ€¦Ã‚Â¡ÃƒÆ’Ã¢â‚¬Å¡Ãƒâ€šÃ‚Â¬ÃƒÆ’Ã†â€™Ãƒâ€šÃ‚Â¢ÃƒÆ’Ã‚Â¢ÃƒÂ¢Ã¢â‚¬Å¡Ã‚Â¬Ãƒâ€¦Ã‚Â¾ÃƒÆ’Ã¢â‚¬Å¡Ãƒâ€šÃ‚Â¢ÃƒÆ’Ã†â€™Ãƒâ€ Ã¢â‚¬â„¢ÃƒÆ’Ã¢â‚¬Â ÃƒÂ¢Ã¢â€šÂ¬Ã¢â€žÂ¢ÃƒÆ’Ã†â€™ÃƒÂ¢Ã¢â€šÂ¬Ã‚Â ÃƒÆ’Ã‚Â¢ÃƒÂ¢Ã¢â‚¬Å¡Ã‚Â¬ÃƒÂ¢Ã¢â‚¬Å¾Ã‚Â¢ÃƒÆ’Ã†â€™Ãƒâ€ Ã¢â‚¬â„¢ÃƒÆ’Ã¢â‚¬Å¡Ãƒâ€šÃ‚Â¢ÃƒÆ’Ã†â€™Ãƒâ€šÃ‚Â¢ÃƒÆ’Ã‚Â¢ÃƒÂ¢Ã¢â‚¬Å¡Ã‚Â¬Ãƒâ€¦Ã‚Â¡ÃƒÆ’Ã¢â‚¬Å¡Ãƒâ€šÃ‚Â¬ÃƒÆ’Ã†â€™ÃƒÂ¢Ã¢â€šÂ¬Ã‚Â¦ÃƒÆ’Ã¢â‚¬Å¡Ãƒâ€šÃ‚Â¡ÃƒÆ’Ã†â€™Ãƒâ€ Ã¢â‚¬â„¢ÃƒÆ’Ã¢â‚¬Â ÃƒÂ¢Ã¢â€šÂ¬Ã¢â€žÂ¢ÃƒÆ’Ã†â€™Ãƒâ€šÃ‚Â¢ÃƒÆ’Ã‚Â¢ÃƒÂ¢Ã¢â€šÂ¬Ã…Â¡Ãƒâ€šÃ‚Â¬ÃƒÆ’Ã¢â‚¬Â¦Ãƒâ€šÃ‚Â¡ÃƒÆ’Ã†â€™Ãƒâ€ Ã¢â‚¬â„¢ÃƒÆ’Ã‚Â¢ÃƒÂ¢Ã¢â‚¬Å¡Ã‚Â¬Ãƒâ€¦Ã‚Â¡ÃƒÆ’Ã†â€™ÃƒÂ¢Ã¢â€šÂ¬Ã…Â¡ÃƒÆ’Ã¢â‚¬Å¡Ãƒâ€šÃ‚Â¢ÃƒÆ’Ã†â€™Ãƒâ€ Ã¢â‚¬â„¢ÃƒÆ’Ã¢â‚¬Â ÃƒÂ¢Ã¢â€šÂ¬Ã¢â€žÂ¢ÃƒÆ’Ã†â€™ÃƒÂ¢Ã¢â€šÂ¬Ã‚Â ÃƒÆ’Ã‚Â¢ÃƒÂ¢Ã¢â‚¬Å¡Ã‚Â¬ÃƒÂ¢Ã¢â‚¬Å¾Ã‚Â¢ÃƒÆ’Ã†â€™Ãƒâ€ Ã¢â‚¬â„¢ÃƒÆ’Ã‚Â¢ÃƒÂ¢Ã¢â‚¬Å¡Ã‚Â¬Ãƒâ€šÃ‚Â ÃƒÆ’Ã†â€™Ãƒâ€šÃ‚Â¢ÃƒÆ’Ã‚Â¢ÃƒÂ¢Ã¢â€šÂ¬Ã…Â¡Ãƒâ€šÃ‚Â¬ÃƒÆ’Ã‚Â¢ÃƒÂ¢Ã¢â€šÂ¬Ã…Â¾Ãƒâ€šÃ‚Â¢ÃƒÆ’Ã†â€™Ãƒâ€ Ã¢â‚¬â„¢ÃƒÆ’Ã¢â‚¬Â ÃƒÂ¢Ã¢â€šÂ¬Ã¢â€žÂ¢ÃƒÆ’Ã†â€™Ãƒâ€šÃ‚Â¢ÃƒÆ’Ã‚Â¢ÃƒÂ¢Ã¢â€šÂ¬Ã…Â¡Ãƒâ€šÃ‚Â¬ÃƒÆ’Ã¢â‚¬Â¦Ãƒâ€šÃ‚Â¡ÃƒÆ’Ã†â€™Ãƒâ€ Ã¢â‚¬â„¢ÃƒÆ’Ã‚Â¢ÃƒÂ¢Ã¢â‚¬Å¡Ã‚Â¬Ãƒâ€¦Ã‚Â¡ÃƒÆ’Ã†â€™ÃƒÂ¢Ã¢â€šÂ¬Ã…Â¡ÃƒÆ’Ã¢â‚¬Å¡Ãƒâ€šÃ‚Â¢ÃƒÆ’Ã†â€™Ãƒâ€ Ã¢â‚¬â„¢ÃƒÆ’Ã¢â‚¬Â ÃƒÂ¢Ã¢â€šÂ¬Ã¢â€žÂ¢ÃƒÆ’Ã†â€™ÃƒÂ¢Ã¢â€šÂ¬Ã‚Â ÃƒÆ’Ã‚Â¢ÃƒÂ¢Ã¢â‚¬Å¡Ã‚Â¬ÃƒÂ¢Ã¢â‚¬Å¾Ã‚Â¢ÃƒÆ’Ã†â€™Ãƒâ€ Ã¢â‚¬â„¢ÃƒÆ’Ã‚Â¢ÃƒÂ¢Ã¢â‚¬Å¡Ã‚Â¬Ãƒâ€¦Ã‚Â¡ÃƒÆ’Ã†â€™ÃƒÂ¢Ã¢â€šÂ¬Ã…Â¡ÃƒÆ’Ã¢â‚¬Å¡Ãƒâ€šÃ‚Â¢ÃƒÆ’Ã†â€™Ãƒâ€ Ã¢â‚¬â„¢ÃƒÆ’Ã¢â‚¬Â ÃƒÂ¢Ã¢â€šÂ¬Ã¢â€žÂ¢ÃƒÆ’Ã†â€™ÃƒÂ¢Ã¢â€šÂ¬Ã…Â¡ÃƒÆ’Ã¢â‚¬Å¡Ãƒâ€šÃ‚Â¢ÃƒÆ’Ã†â€™Ãƒâ€ Ã¢â‚¬â„¢ÃƒÆ’Ã¢â‚¬Å¡Ãƒâ€šÃ‚Â¢ÃƒÆ’Ã†â€™Ãƒâ€šÃ‚Â¢ÃƒÆ’Ã‚Â¢ÃƒÂ¢Ã¢â‚¬Å¡Ã‚Â¬Ãƒâ€¦Ã‚Â¡ÃƒÆ’Ã¢â‚¬Å¡Ãƒâ€šÃ‚Â¬ÃƒÆ’Ã†â€™ÃƒÂ¢Ã¢â€šÂ¬Ã‚Â¦ÃƒÆ’Ã¢â‚¬Å¡Ãƒâ€šÃ‚Â¡ÃƒÆ’Ã†â€™Ãƒâ€ Ã¢â‚¬â„¢ÃƒÆ’Ã‚Â¢ÃƒÂ¢Ã¢â‚¬Å¡Ã‚Â¬Ãƒâ€¦Ã‚Â¡ÃƒÆ’Ã†â€™ÃƒÂ¢Ã¢â€šÂ¬Ã…Â¡ÃƒÆ’Ã¢â‚¬Å¡Ãƒâ€šÃ‚Â¬ÃƒÆ’Ã†â€™Ãƒâ€ Ã¢â‚¬â„¢ÃƒÆ’Ã¢â‚¬Â ÃƒÂ¢Ã¢â€šÂ¬Ã¢â€žÂ¢ÃƒÆ’Ã†â€™Ãƒâ€šÃ‚Â¢ÃƒÆ’Ã‚Â¢ÃƒÂ¢Ã¢â€šÂ¬Ã…Â¡Ãƒâ€šÃ‚Â¬ÃƒÆ’Ã¢â‚¬Å¡Ãƒâ€šÃ‚Â¦ÃƒÆ’Ã†â€™Ãƒâ€ Ã¢â‚¬â„¢ÃƒÆ’Ã‚Â¢ÃƒÂ¢Ã¢â‚¬Å¡Ã‚Â¬Ãƒâ€¦Ã‚Â¡ÃƒÆ’Ã†â€™ÃƒÂ¢Ã¢â€šÂ¬Ã…Â¡ÃƒÆ’Ã¢â‚¬Å¡Ãƒâ€šÃ‚Â¡ÃƒÆ’Ã†â€™Ãƒâ€ Ã¢â‚¬â„¢ÃƒÆ’Ã¢â‚¬Â ÃƒÂ¢Ã¢â€šÂ¬Ã¢â€žÂ¢ÃƒÆ’Ã†â€™ÃƒÂ¢Ã¢â€šÂ¬Ã‚Â ÃƒÆ’Ã‚Â¢ÃƒÂ¢Ã¢â‚¬Å¡Ã‚Â¬ÃƒÂ¢Ã¢â‚¬Å¾Ã‚Â¢ÃƒÆ’Ã†â€™Ãƒâ€ Ã¢â‚¬â„¢ÃƒÆ’Ã¢â‚¬Å¡Ãƒâ€šÃ‚Â¢ÃƒÆ’Ã†â€™Ãƒâ€šÃ‚Â¢ÃƒÆ’Ã‚Â¢ÃƒÂ¢Ã¢â‚¬Å¡Ã‚Â¬Ãƒâ€¦Ã‚Â¡ÃƒÆ’Ã¢â‚¬Å¡Ãƒâ€šÃ‚Â¬ÃƒÆ’Ã†â€™ÃƒÂ¢Ã¢â€šÂ¬Ã‚Â¦ÃƒÆ’Ã¢â‚¬Å¡Ãƒâ€šÃ‚Â¡ÃƒÆ’Ã†â€™Ãƒâ€ Ã¢â‚¬â„¢ÃƒÆ’Ã¢â‚¬Â ÃƒÂ¢Ã¢â€šÂ¬Ã¢â€žÂ¢ÃƒÆ’Ã†â€™Ãƒâ€šÃ‚Â¢ÃƒÆ’Ã‚Â¢ÃƒÂ¢Ã¢â€šÂ¬Ã…Â¡Ãƒâ€šÃ‚Â¬ÃƒÆ’Ã¢â‚¬Â¦Ãƒâ€šÃ‚Â¡ÃƒÆ’Ã†â€™Ãƒâ€ Ã¢â‚¬â„¢ÃƒÆ’Ã‚Â¢ÃƒÂ¢Ã¢â‚¬Å¡Ã‚Â¬Ãƒâ€¦Ã‚Â¡ÃƒÆ’Ã†â€™ÃƒÂ¢Ã¢â€šÂ¬Ã…Â¡ÃƒÆ’Ã¢â‚¬Å¡Ãƒâ€šÃ‚Â¬ÃƒÆ’Ã†â€™Ãƒâ€ Ã¢â‚¬â„¢ÃƒÆ’Ã¢â‚¬Â ÃƒÂ¢Ã¢â€šÂ¬Ã¢â€žÂ¢ÃƒÆ’Ã†â€™ÃƒÂ¢Ã¢â€šÂ¬Ã‚Â ÃƒÆ’Ã‚Â¢ÃƒÂ¢Ã¢â‚¬Å¡Ã‚Â¬ÃƒÂ¢Ã¢â‚¬Å¾Ã‚Â¢ÃƒÆ’Ã†â€™Ãƒâ€ Ã¢â‚¬â„¢ÃƒÆ’Ã‚Â¢ÃƒÂ¢Ã¢â‚¬Å¡Ã‚Â¬Ãƒâ€šÃ‚Â ÃƒÆ’Ã†â€™Ãƒâ€šÃ‚Â¢ÃƒÆ’Ã‚Â¢ÃƒÂ¢Ã¢â€šÂ¬Ã…Â¡Ãƒâ€šÃ‚Â¬ÃƒÆ’Ã‚Â¢ÃƒÂ¢Ã¢â€šÂ¬Ã…Â¾Ãƒâ€šÃ‚Â¢ÃƒÆ’Ã†â€™Ãƒâ€ Ã¢â‚¬â„¢ÃƒÆ’Ã¢â‚¬Â ÃƒÂ¢Ã¢â€šÂ¬Ã¢â€žÂ¢ÃƒÆ’Ã†â€™Ãƒâ€šÃ‚Â¢ÃƒÆ’Ã‚Â¢ÃƒÂ¢Ã¢â€šÂ¬Ã…Â¡Ãƒâ€šÃ‚Â¬ÃƒÆ’Ã¢â‚¬Â¦Ãƒâ€šÃ‚Â¡ÃƒÆ’Ã†â€™Ãƒâ€ Ã¢â‚¬â„¢ÃƒÆ’Ã‚Â¢ÃƒÂ¢Ã¢â‚¬Å¡Ã‚Â¬Ãƒâ€¦Ã‚Â¡ÃƒÆ’Ã†â€™ÃƒÂ¢Ã¢â€šÂ¬Ã…Â¡ÃƒÆ’Ã¢â‚¬Å¡Ãƒâ€šÃ‚Â¢ÃƒÆ’Ã†â€™Ãƒâ€ Ã¢â‚¬â„¢ÃƒÆ’Ã¢â‚¬Â ÃƒÂ¢Ã¢â€šÂ¬Ã¢â€žÂ¢ÃƒÆ’Ã†â€™ÃƒÂ¢Ã¢â€šÂ¬Ã‚Â ÃƒÆ’Ã‚Â¢ÃƒÂ¢Ã¢â‚¬Å¡Ã‚Â¬ÃƒÂ¢Ã¢â‚¬Å¾Ã‚Â¢ÃƒÆ’Ã†â€™Ãƒâ€ Ã¢â‚¬â„¢ÃƒÆ’Ã‚Â¢ÃƒÂ¢Ã¢â‚¬Å¡Ã‚Â¬Ãƒâ€¦Ã‚Â¡ÃƒÆ’Ã†â€™ÃƒÂ¢Ã¢â€šÂ¬Ã…Â¡ÃƒÆ’Ã¢â‚¬Å¡Ãƒâ€šÃ‚Â¢ÃƒÆ’Ã†â€™Ãƒâ€ Ã¢â‚¬â„¢ÃƒÆ’Ã¢â‚¬Â ÃƒÂ¢Ã¢â€šÂ¬Ã¢â€žÂ¢ÃƒÆ’Ã†â€™ÃƒÂ¢Ã¢â€šÂ¬Ã…Â¡ÃƒÆ’Ã¢â‚¬Å¡Ãƒâ€šÃ‚Â¢ÃƒÆ’Ã†â€™Ãƒâ€ Ã¢â‚¬â„¢ÃƒÆ’Ã¢â‚¬Å¡Ãƒâ€šÃ‚Â¢ÃƒÆ’Ã†â€™Ãƒâ€šÃ‚Â¢ÃƒÆ’Ã‚Â¢ÃƒÂ¢Ã¢â€šÂ¬Ã…Â¡Ãƒâ€šÃ‚Â¬ÃƒÆ’Ã¢â‚¬Â¦Ãƒâ€šÃ‚Â¡ÃƒÆ’Ã†â€™ÃƒÂ¢Ã¢â€šÂ¬Ã…Â¡ÃƒÆ’Ã¢â‚¬Å¡Ãƒâ€šÃ‚Â¬ÃƒÆ’Ã†â€™Ãƒâ€ Ã¢â‚¬â„¢ÃƒÆ’Ã‚Â¢ÃƒÂ¢Ã¢â‚¬Å¡Ã‚Â¬Ãƒâ€šÃ‚Â¦ÃƒÆ’Ã†â€™ÃƒÂ¢Ã¢â€šÂ¬Ã…Â¡ÃƒÆ’Ã¢â‚¬Å¡Ãƒâ€šÃ‚Â¡ÃƒÆ’Ã†â€™Ãƒâ€ Ã¢â‚¬â„¢ÃƒÆ’Ã¢â‚¬Â ÃƒÂ¢Ã¢â€šÂ¬Ã¢â€žÂ¢ÃƒÆ’Ã†â€™Ãƒâ€šÃ‚Â¢ÃƒÆ’Ã‚Â¢ÃƒÂ¢Ã¢â€šÂ¬Ã…Â¡Ãƒâ€šÃ‚Â¬ÃƒÆ’Ã¢â‚¬Â¦Ãƒâ€šÃ‚Â¡ÃƒÆ’Ã†â€™Ãƒâ€ Ã¢â‚¬â„¢ÃƒÆ’Ã‚Â¢ÃƒÂ¢Ã¢â‚¬Å¡Ã‚Â¬Ãƒâ€¦Ã‚Â¡ÃƒÆ’Ã†â€™ÃƒÂ¢Ã¢â€šÂ¬Ã…Â¡ÃƒÆ’Ã¢â‚¬Å¡Ãƒâ€šÃ‚Â¬ÃƒÆ’Ã†â€™Ãƒâ€ Ã¢â‚¬â„¢ÃƒÆ’Ã¢â‚¬Â ÃƒÂ¢Ã¢â€šÂ¬Ã¢â€žÂ¢ÃƒÆ’Ã†â€™ÃƒÂ¢Ã¢â€šÂ¬Ã‚Â ÃƒÆ’Ã‚Â¢ÃƒÂ¢Ã¢â‚¬Å¡Ã‚Â¬ÃƒÂ¢Ã¢â‚¬Å¾Ã‚Â¢ÃƒÆ’Ã†â€™Ãƒâ€ Ã¢â‚¬â„¢ÃƒÆ’Ã¢â‚¬Å¡Ãƒâ€šÃ‚Â¢ÃƒÆ’Ã†â€™Ãƒâ€šÃ‚Â¢ÃƒÆ’Ã‚Â¢ÃƒÂ¢Ã¢â‚¬Å¡Ã‚Â¬Ãƒâ€¦Ã‚Â¡ÃƒÆ’Ã¢â‚¬Å¡Ãƒâ€šÃ‚Â¬ÃƒÆ’Ã†â€™ÃƒÂ¢Ã¢â€šÂ¬Ã…Â¡ÃƒÆ’Ã¢â‚¬Å¡Ãƒâ€šÃ‚Â¦ÃƒÆ’Ã†â€™Ãƒâ€ Ã¢â‚¬â„¢ÃƒÆ’Ã¢â‚¬Â ÃƒÂ¢Ã¢â€šÂ¬Ã¢â€žÂ¢ÃƒÆ’Ã†â€™ÃƒÂ¢Ã¢â€šÂ¬Ã…Â¡ÃƒÆ’Ã¢â‚¬Å¡Ãƒâ€šÃ‚Â¢ÃƒÆ’Ã†â€™Ãƒâ€ Ã¢â‚¬â„¢ÃƒÆ’Ã¢â‚¬Å¡Ãƒâ€šÃ‚Â¢ÃƒÆ’Ã†â€™Ãƒâ€šÃ‚Â¢ÃƒÆ’Ã‚Â¢ÃƒÂ¢Ã¢â€šÂ¬Ã…Â¡Ãƒâ€šÃ‚Â¬ÃƒÆ’Ã¢â‚¬Â¦Ãƒâ€šÃ‚Â¡ÃƒÆ’Ã†â€™ÃƒÂ¢Ã¢â€šÂ¬Ã…Â¡ÃƒÆ’Ã¢â‚¬Å¡Ãƒâ€šÃ‚Â¬ÃƒÆ’Ã†â€™Ãƒâ€ Ã¢â‚¬â„¢ÃƒÆ’Ã‚Â¢ÃƒÂ¢Ã¢â‚¬Å¡Ã‚Â¬Ãƒâ€šÃ‚Â¦ÃƒÆ’Ã†â€™Ãƒâ€šÃ‚Â¢ÃƒÆ’Ã‚Â¢ÃƒÂ¢Ã¢â€šÂ¬Ã…Â¡Ãƒâ€šÃ‚Â¬ÃƒÆ’Ã¢â‚¬Â¦ÃƒÂ¢Ã¢â€šÂ¬Ã…â€œWk6), both systems recovered, with Monoculture reaching a higher peak growth rate (4.872%/day) compared to IMTA (2.246%/day). Overall, although Monoculture showed higher peak SGR values, the IMTA system demonstrated more stable and consistent </w:t>
+        <w:t xml:space="preserve"> (%/day) in IMTA and Monoculture systems across four sampling intervals. Overall, both treatments show fluctuating growth patterns, including phases of weight loss and recovery. During the initial adaptation phase (Wk2ÃƒÆ’Ã†â€™Ãƒâ€ Ã¢â‚¬â„¢ÃƒÆ’Ã¢â‚¬Â ÃƒÂ¢Ã¢â€šÂ¬Ã¢â€žÂ¢ÃƒÆ’Ã†â€™ÃƒÂ¢Ã¢â€šÂ¬Ã‚Â ÃƒÆ’Ã‚Â¢ÃƒÂ¢Ã¢â‚¬Å¡Ã‚Â¬ÃƒÂ¢Ã¢â‚¬Å¾Ã‚Â¢ÃƒÆ’Ã†â€™Ãƒâ€ Ã¢â‚¬â„¢ÃƒÆ’Ã‚Â¢ÃƒÂ¢Ã¢â‚¬Å¡Ã‚Â¬Ãƒâ€šÃ‚Â ÃƒÆ’Ã†â€™Ãƒâ€šÃ‚Â¢ÃƒÆ’Ã‚Â¢ÃƒÂ¢Ã¢â€šÂ¬Ã…Â¡Ãƒâ€šÃ‚Â¬ÃƒÆ’Ã‚Â¢ÃƒÂ¢Ã¢â€šÂ¬Ã…Â¾Ãƒâ€šÃ‚Â¢ÃƒÆ’Ã†â€™Ãƒâ€ Ã¢â‚¬â„¢ÃƒÆ’Ã¢â‚¬Â ÃƒÂ¢Ã¢â€šÂ¬Ã¢â€žÂ¢ÃƒÆ’Ã†â€™Ãƒâ€šÃ‚Â¢ÃƒÆ’Ã‚Â¢ÃƒÂ¢Ã¢â€šÂ¬Ã…Â¡Ãƒâ€šÃ‚Â¬ÃƒÆ’Ã¢â‚¬Å¡Ãƒâ€šÃ‚Â ÃƒÆ’Ã†â€™Ãƒâ€ Ã¢â‚¬â„¢ÃƒÆ’Ã¢â‚¬Å¡Ãƒâ€šÃ‚Â¢ÃƒÆ’Ã†â€™Ãƒâ€šÃ‚Â¢ÃƒÆ’Ã‚Â¢ÃƒÂ¢Ã¢â‚¬Å¡Ã‚Â¬Ãƒâ€¦Ã‚Â¡ÃƒÆ’Ã¢â‚¬Å¡Ãƒâ€šÃ‚Â¬ÃƒÆ’Ã†â€™Ãƒâ€šÃ‚Â¢ÃƒÆ’Ã‚Â¢ÃƒÂ¢Ã¢â‚¬Å¡Ã‚Â¬Ãƒâ€¦Ã‚Â¾ÃƒÆ’Ã¢â‚¬Å¡Ãƒâ€šÃ‚Â¢ÃƒÆ’Ã†â€™Ãƒâ€ Ã¢â‚¬â„¢ÃƒÆ’Ã¢â‚¬Â ÃƒÂ¢Ã¢â€šÂ¬Ã¢â€žÂ¢ÃƒÆ’Ã†â€™ÃƒÂ¢Ã¢â€šÂ¬Ã‚Â ÃƒÆ’Ã‚Â¢ÃƒÂ¢Ã¢â‚¬Å¡Ã‚Â¬ÃƒÂ¢Ã¢â‚¬Å¾Ã‚Â¢ÃƒÆ’Ã†â€™Ãƒâ€ Ã¢â‚¬â„¢ÃƒÆ’Ã¢â‚¬Å¡Ãƒâ€šÃ‚Â¢ÃƒÆ’Ã†â€™Ãƒâ€šÃ‚Â¢ÃƒÆ’Ã‚Â¢ÃƒÂ¢Ã¢â‚¬Å¡Ã‚Â¬Ãƒâ€¦Ã‚Â¡ÃƒÆ’Ã¢â‚¬Å¡Ãƒâ€šÃ‚Â¬ÃƒÆ’Ã†â€™ÃƒÂ¢Ã¢â€šÂ¬Ã…Â¡ÃƒÆ’Ã¢â‚¬Å¡Ãƒâ€šÃ‚Â ÃƒÆ’Ã†â€™Ãƒâ€ Ã¢â‚¬â„¢ÃƒÆ’Ã¢â‚¬Â ÃƒÂ¢Ã¢â€šÂ¬Ã¢â€žÂ¢ÃƒÆ’Ã†â€™ÃƒÂ¢Ã¢â€šÂ¬Ã…Â¡ÃƒÆ’Ã¢â‚¬Å¡Ãƒâ€šÃ‚Â¢ÃƒÆ’Ã†â€™Ãƒâ€ Ã¢â‚¬â„¢ÃƒÆ’Ã¢â‚¬Å¡Ãƒâ€šÃ‚Â¢ÃƒÆ’Ã†â€™Ãƒâ€šÃ‚Â¢ÃƒÆ’Ã‚Â¢ÃƒÂ¢Ã¢â€šÂ¬Ã…Â¡Ãƒâ€šÃ‚Â¬ÃƒÆ’Ã¢â‚¬Â¦Ãƒâ€šÃ‚Â¡ÃƒÆ’Ã†â€™ÃƒÂ¢Ã¢â€šÂ¬Ã…Â¡ÃƒÆ’Ã¢â‚¬Å¡Ãƒâ€šÃ‚Â¬ÃƒÆ’Ã†â€™Ãƒâ€ Ã¢â‚¬â„¢ÃƒÆ’Ã¢â‚¬Å¡Ãƒâ€šÃ‚Â¢ÃƒÆ’Ã†â€™Ãƒâ€šÃ‚Â¢ÃƒÆ’Ã‚Â¢ÃƒÂ¢Ã¢â€šÂ¬Ã…Â¡Ãƒâ€šÃ‚Â¬ÃƒÆ’Ã¢â‚¬Â¦Ãƒâ€šÃ‚Â¾ÃƒÆ’Ã†â€™ÃƒÂ¢Ã¢â€šÂ¬Ã…Â¡ÃƒÆ’Ã¢â‚¬Å¡Ãƒâ€šÃ‚Â¢ÃƒÆ’Ã†â€™Ãƒâ€ Ã¢â‚¬â„¢ÃƒÆ’Ã¢â‚¬Â ÃƒÂ¢Ã¢â€šÂ¬Ã¢â€žÂ¢ÃƒÆ’Ã†â€™ÃƒÂ¢Ã¢â€šÂ¬Ã‚Â ÃƒÆ’Ã‚Â¢ÃƒÂ¢Ã¢â‚¬Å¡Ã‚Â¬ÃƒÂ¢Ã¢â‚¬Å¾Ã‚Â¢ÃƒÆ’Ã†â€™Ãƒâ€ Ã¢â‚¬â„¢ÃƒÆ’Ã‚Â¢ÃƒÂ¢Ã¢â‚¬Å¡Ã‚Â¬Ãƒâ€šÃ‚Â ÃƒÆ’Ã†â€™Ãƒâ€šÃ‚Â¢ÃƒÆ’Ã‚Â¢ÃƒÂ¢Ã¢â€šÂ¬Ã…Â¡Ãƒâ€šÃ‚Â¬ÃƒÆ’Ã‚Â¢ÃƒÂ¢Ã¢â€šÂ¬Ã…Â¾Ãƒâ€šÃ‚Â¢ÃƒÆ’Ã†â€™Ãƒâ€ Ã¢â‚¬â„¢ÃƒÆ’Ã¢â‚¬Â ÃƒÂ¢Ã¢â€šÂ¬Ã¢â€žÂ¢ÃƒÆ’Ã†â€™ÃƒÂ¢Ã¢â€šÂ¬Ã…Â¡ÃƒÆ’Ã¢â‚¬Å¡Ãƒâ€šÃ‚Â¢ÃƒÆ’Ã†â€™Ãƒâ€ Ã¢â‚¬â„¢ÃƒÆ’Ã¢â‚¬Å¡Ãƒâ€šÃ‚Â¢ÃƒÆ’Ã†â€™Ãƒâ€šÃ‚Â¢ÃƒÆ’Ã‚Â¢ÃƒÂ¢Ã¢â€šÂ¬Ã…Â¡Ãƒâ€šÃ‚Â¬ÃƒÆ’Ã¢â‚¬Â¦Ãƒâ€šÃ‚Â¡ÃƒÆ’Ã†â€™ÃƒÂ¢Ã¢â€šÂ¬Ã…Â¡ÃƒÆ’Ã¢â‚¬Å¡Ãƒâ€šÃ‚Â¬ÃƒÆ’Ã†â€™Ãƒâ€ Ã¢â‚¬â„¢ÃƒÆ’Ã‚Â¢ÃƒÂ¢Ã¢â‚¬Å¡Ã‚Â¬Ãƒâ€šÃ‚Â¦ÃƒÆ’Ã†â€™ÃƒÂ¢Ã¢â€šÂ¬Ã…Â¡ÃƒÆ’Ã¢â‚¬Å¡Ãƒâ€šÃ‚Â¡ÃƒÆ’Ã†â€™Ãƒâ€ Ã¢â‚¬â„¢ÃƒÆ’Ã¢â‚¬Â ÃƒÂ¢Ã¢â€šÂ¬Ã¢â€žÂ¢ÃƒÆ’Ã†â€™ÃƒÂ¢Ã¢â€šÂ¬Ã‚Â ÃƒÆ’Ã‚Â¢ÃƒÂ¢Ã¢â‚¬Å¡Ã‚Â¬ÃƒÂ¢Ã¢â‚¬Å¾Ã‚Â¢ÃƒÆ’Ã†â€™Ãƒâ€ Ã¢â‚¬â„¢ÃƒÆ’Ã¢â‚¬Å¡Ãƒâ€šÃ‚Â¢ÃƒÆ’Ã†â€™Ãƒâ€šÃ‚Â¢ÃƒÆ’Ã‚Â¢ÃƒÂ¢Ã¢â‚¬Å¡Ã‚Â¬Ãƒâ€¦Ã‚Â¡ÃƒÆ’Ã¢â‚¬Å¡Ãƒâ€šÃ‚Â¬ÃƒÆ’Ã†â€™ÃƒÂ¢Ã¢â€šÂ¬Ã‚Â¦ÃƒÆ’Ã¢â‚¬Å¡Ãƒâ€šÃ‚Â¡ÃƒÆ’Ã†â€™Ãƒâ€ Ã¢â‚¬â„¢ÃƒÆ’Ã¢â‚¬Â ÃƒÂ¢Ã¢â€šÂ¬Ã¢â€žÂ¢ÃƒÆ’Ã†â€™Ãƒâ€šÃ‚Â¢ÃƒÆ’Ã‚Â¢ÃƒÂ¢Ã¢â€šÂ¬Ã…Â¡Ãƒâ€šÃ‚Â¬ÃƒÆ’Ã¢â‚¬Â¦Ãƒâ€šÃ‚Â¡ÃƒÆ’Ã†â€™Ãƒâ€ Ã¢â‚¬â„¢ÃƒÆ’Ã‚Â¢ÃƒÂ¢Ã¢â‚¬Å¡Ã‚Â¬Ãƒâ€¦Ã‚Â¡ÃƒÆ’Ã†â€™ÃƒÂ¢Ã¢â€šÂ¬Ã…Â¡ÃƒÆ’Ã¢â‚¬Å¡Ãƒâ€šÃ‚Â¢ÃƒÆ’Ã†â€™Ãƒâ€ Ã¢â‚¬â„¢ÃƒÆ’Ã¢â‚¬Â ÃƒÂ¢Ã¢â€šÂ¬Ã¢â€žÂ¢ÃƒÆ’Ã†â€™ÃƒÂ¢Ã¢â€šÂ¬Ã‚Â ÃƒÆ’Ã‚Â¢ÃƒÂ¢Ã¢â‚¬Å¡Ã‚Â¬ÃƒÂ¢Ã¢â‚¬Å¾Ã‚Â¢ÃƒÆ’Ã†â€™Ãƒâ€ Ã¢â‚¬â„¢ÃƒÆ’Ã‚Â¢ÃƒÂ¢Ã¢â‚¬Å¡Ã‚Â¬Ãƒâ€šÃ‚Â ÃƒÆ’Ã†â€™Ãƒâ€šÃ‚Â¢ÃƒÆ’Ã‚Â¢ÃƒÂ¢Ã¢â€šÂ¬Ã…Â¡Ãƒâ€šÃ‚Â¬ÃƒÆ’Ã‚Â¢ÃƒÂ¢Ã¢â€šÂ¬Ã…Â¾Ãƒâ€šÃ‚Â¢ÃƒÆ’Ã†â€™Ãƒâ€ Ã¢â‚¬â„¢ÃƒÆ’Ã¢â‚¬Â ÃƒÂ¢Ã¢â€šÂ¬Ã¢â€žÂ¢ÃƒÆ’Ã†â€™Ãƒâ€šÃ‚Â¢ÃƒÆ’Ã‚Â¢ÃƒÂ¢Ã¢â€šÂ¬Ã…Â¡Ãƒâ€šÃ‚Â¬ÃƒÆ’Ã¢â‚¬Å¡Ãƒâ€šÃ‚Â ÃƒÆ’Ã†â€™Ãƒâ€ Ã¢â‚¬â„¢ÃƒÆ’Ã¢â‚¬Å¡Ãƒâ€šÃ‚Â¢ÃƒÆ’Ã†â€™Ãƒâ€šÃ‚Â¢ÃƒÆ’Ã‚Â¢ÃƒÂ¢Ã¢â‚¬Å¡Ã‚Â¬Ãƒâ€¦Ã‚Â¡ÃƒÆ’Ã¢â‚¬Å¡Ãƒâ€šÃ‚Â¬ÃƒÆ’Ã†â€™Ãƒâ€šÃ‚Â¢ÃƒÆ’Ã‚Â¢ÃƒÂ¢Ã¢â‚¬Å¡Ã‚Â¬Ãƒâ€¦Ã‚Â¾ÃƒÆ’Ã¢â‚¬Å¡Ãƒâ€šÃ‚Â¢ÃƒÆ’Ã†â€™Ãƒâ€ Ã¢â‚¬â„¢ÃƒÆ’Ã¢â‚¬Â ÃƒÂ¢Ã¢â€šÂ¬Ã¢â€žÂ¢ÃƒÆ’Ã†â€™ÃƒÂ¢Ã¢â€šÂ¬Ã‚Â ÃƒÆ’Ã‚Â¢ÃƒÂ¢Ã¢â‚¬Å¡Ã‚Â¬ÃƒÂ¢Ã¢â‚¬Å¾Ã‚Â¢ÃƒÆ’Ã†â€™Ãƒâ€ Ã¢â‚¬â„¢ÃƒÆ’Ã¢â‚¬Å¡Ãƒâ€šÃ‚Â¢ÃƒÆ’Ã†â€™Ãƒâ€šÃ‚Â¢ÃƒÆ’Ã‚Â¢ÃƒÂ¢Ã¢â‚¬Å¡Ã‚Â¬Ãƒâ€¦Ã‚Â¡ÃƒÆ’Ã¢â‚¬Å¡Ãƒâ€šÃ‚Â¬ÃƒÆ’Ã†â€™ÃƒÂ¢Ã¢â€šÂ¬Ã‚Â¦ÃƒÆ’Ã¢â‚¬Å¡Ãƒâ€šÃ‚Â¡ÃƒÆ’Ã†â€™Ãƒâ€ Ã¢â‚¬â„¢ÃƒÆ’Ã¢â‚¬Â ÃƒÂ¢Ã¢â€šÂ¬Ã¢â€žÂ¢ÃƒÆ’Ã†â€™Ãƒâ€šÃ‚Â¢ÃƒÆ’Ã‚Â¢ÃƒÂ¢Ã¢â€šÂ¬Ã…Â¡Ãƒâ€šÃ‚Â¬ÃƒÆ’Ã¢â‚¬Â¦Ãƒâ€šÃ‚Â¡ÃƒÆ’Ã†â€™Ãƒâ€ Ã¢â‚¬â„¢ÃƒÆ’Ã‚Â¢ÃƒÂ¢Ã¢â‚¬Å¡Ã‚Â¬Ãƒâ€¦Ã‚Â¡ÃƒÆ’Ã†â€™ÃƒÂ¢Ã¢â€šÂ¬Ã…Â¡ÃƒÆ’Ã¢â‚¬Å¡Ãƒâ€šÃ‚Â¢ÃƒÆ’Ã†â€™Ãƒâ€ Ã¢â‚¬â„¢ÃƒÆ’Ã¢â‚¬Â ÃƒÂ¢Ã¢â€šÂ¬Ã¢â€žÂ¢ÃƒÆ’Ã†â€™ÃƒÂ¢Ã¢â€šÂ¬Ã‚Â ÃƒÆ’Ã‚Â¢ÃƒÂ¢Ã¢â‚¬Å¡Ã‚Â¬ÃƒÂ¢Ã¢â‚¬Å¾Ã‚Â¢ÃƒÆ’Ã†â€™Ãƒâ€ Ã¢â‚¬â„¢ÃƒÆ’Ã‚Â¢ÃƒÂ¢Ã¢â‚¬Å¡Ã‚Â¬Ãƒâ€šÃ‚Â ÃƒÆ’Ã†â€™Ãƒâ€šÃ‚Â¢ÃƒÆ’Ã‚Â¢ÃƒÂ¢Ã¢â€šÂ¬Ã…Â¡Ãƒâ€šÃ‚Â¬ÃƒÆ’Ã‚Â¢ÃƒÂ¢Ã¢â€šÂ¬Ã…Â¾Ãƒâ€šÃ‚Â¢ÃƒÆ’Ã†â€™Ãƒâ€ Ã¢â‚¬â„¢ÃƒÆ’Ã¢â‚¬Â ÃƒÂ¢Ã¢â€šÂ¬Ã¢â€žÂ¢ÃƒÆ’Ã†â€™Ãƒâ€šÃ‚Â¢ÃƒÆ’Ã‚Â¢ÃƒÂ¢Ã¢â€šÂ¬Ã…Â¡Ãƒâ€šÃ‚Â¬ÃƒÆ’Ã¢â‚¬Â¦Ãƒâ€šÃ‚Â¡ÃƒÆ’Ã†â€™Ãƒâ€ Ã¢â‚¬â„¢ÃƒÆ’Ã‚Â¢ÃƒÂ¢Ã¢â‚¬Å¡Ã‚Â¬Ãƒâ€¦Ã‚Â¡ÃƒÆ’Ã†â€™ÃƒÂ¢Ã¢â€šÂ¬Ã…Â¡ÃƒÆ’Ã¢â‚¬Å¡Ãƒâ€šÃ‚Â¢ÃƒÆ’Ã†â€™Ãƒâ€ Ã¢â‚¬â„¢ÃƒÆ’Ã¢â‚¬Â ÃƒÂ¢Ã¢â€šÂ¬Ã¢â€žÂ¢ÃƒÆ’Ã†â€™ÃƒÂ¢Ã¢â€šÂ¬Ã‚Â ÃƒÆ’Ã‚Â¢ÃƒÂ¢Ã¢â‚¬Å¡Ã‚Â¬ÃƒÂ¢Ã¢â‚¬Å¾Ã‚Â¢ÃƒÆ’Ã†â€™Ãƒâ€ Ã¢â‚¬â„¢ÃƒÆ’Ã‚Â¢ÃƒÂ¢Ã¢â‚¬Å¡Ã‚Â¬Ãƒâ€¦Ã‚Â¡ÃƒÆ’Ã†â€™ÃƒÂ¢Ã¢â€šÂ¬Ã…Â¡ÃƒÆ’Ã¢â‚¬Å¡Ãƒâ€šÃ‚Â¢ÃƒÆ’Ã†â€™Ãƒâ€ Ã¢â‚¬â„¢ÃƒÆ’Ã¢â‚¬Â ÃƒÂ¢Ã¢â€šÂ¬Ã¢â€žÂ¢ÃƒÆ’Ã†â€™ÃƒÂ¢Ã¢â€šÂ¬Ã…Â¡ÃƒÆ’Ã¢â‚¬Å¡Ãƒâ€šÃ‚Â¢ÃƒÆ’Ã†â€™Ãƒâ€ Ã¢â‚¬â„¢ÃƒÆ’Ã¢â‚¬Å¡Ãƒâ€šÃ‚Â¢ÃƒÆ’Ã†â€™Ãƒâ€šÃ‚Â¢ÃƒÆ’Ã‚Â¢ÃƒÂ¢Ã¢â€šÂ¬Ã…Â¡Ãƒâ€šÃ‚Â¬ÃƒÆ’Ã¢â‚¬Â¦Ãƒâ€šÃ‚Â¡ÃƒÆ’Ã†â€™ÃƒÂ¢Ã¢â€šÂ¬Ã…Â¡ÃƒÆ’Ã¢â‚¬Å¡Ãƒâ€šÃ‚Â¬ÃƒÆ’Ã†â€™Ãƒâ€ Ã¢â‚¬â„¢ÃƒÆ’Ã‚Â¢ÃƒÂ¢Ã¢â‚¬Å¡Ã‚Â¬Ãƒâ€šÃ‚Â¦ÃƒÆ’Ã†â€™ÃƒÂ¢Ã¢â€šÂ¬Ã…Â¡ÃƒÆ’Ã¢â‚¬Å¡Ãƒâ€šÃ‚Â¡ÃƒÆ’Ã†â€™Ãƒâ€ Ã¢â‚¬â„¢ÃƒÆ’Ã¢â‚¬Â ÃƒÂ¢Ã¢â€šÂ¬Ã¢â€žÂ¢ÃƒÆ’Ã†â€™Ãƒâ€šÃ‚Â¢ÃƒÆ’Ã‚Â¢ÃƒÂ¢Ã¢â€šÂ¬Ã…Â¡Ãƒâ€šÃ‚Â¬ÃƒÆ’Ã¢â‚¬Â¦Ãƒâ€šÃ‚Â¡ÃƒÆ’Ã†â€™Ãƒâ€ Ã¢â‚¬â„¢ÃƒÆ’Ã‚Â¢ÃƒÂ¢Ã¢â‚¬Å¡Ã‚Â¬Ãƒâ€¦Ã‚Â¡ÃƒÆ’Ã†â€™ÃƒÂ¢Ã¢â€šÂ¬Ã…Â¡ÃƒÆ’Ã¢â‚¬Å¡Ãƒâ€šÃ‚Â¬ÃƒÆ’Ã†â€™Ãƒâ€ Ã¢â‚¬â„¢ÃƒÆ’Ã¢â‚¬Â ÃƒÂ¢Ã¢â€šÂ¬Ã¢â€žÂ¢ÃƒÆ’Ã†â€™ÃƒÂ¢Ã¢â€šÂ¬Ã‚Â ÃƒÆ’Ã‚Â¢ÃƒÂ¢Ã¢â‚¬Å¡Ã‚Â¬ÃƒÂ¢Ã¢â‚¬Å¾Ã‚Â¢ÃƒÆ’Ã†â€™Ãƒâ€ Ã¢â‚¬â„¢ÃƒÆ’Ã¢â‚¬Å¡Ãƒâ€šÃ‚Â¢ÃƒÆ’Ã†â€™Ãƒâ€šÃ‚Â¢ÃƒÆ’Ã‚Â¢ÃƒÂ¢Ã¢â‚¬Å¡Ã‚Â¬Ãƒâ€¦Ã‚Â¡ÃƒÆ’Ã¢â‚¬Å¡Ãƒâ€šÃ‚Â¬ÃƒÆ’Ã†â€™ÃƒÂ¢Ã¢â€šÂ¬Ã…Â¡ÃƒÆ’Ã¢â‚¬Å¡Ãƒâ€šÃ‚Â¦ÃƒÆ’Ã†â€™Ãƒâ€ Ã¢â‚¬â„¢ÃƒÆ’Ã¢â‚¬Â ÃƒÂ¢Ã¢â€šÂ¬Ã¢â€žÂ¢ÃƒÆ’Ã†â€™Ãƒâ€šÃ‚Â¢ÃƒÆ’Ã‚Â¢ÃƒÂ¢Ã¢â€šÂ¬Ã…Â¡Ãƒâ€šÃ‚Â¬ÃƒÆ’Ã¢â‚¬Â¦Ãƒâ€šÃ‚Â¡ÃƒÆ’Ã†â€™Ãƒâ€ Ã¢â‚¬â„¢ÃƒÆ’Ã‚Â¢ÃƒÂ¢Ã¢â‚¬Å¡Ã‚Â¬Ãƒâ€¦Ã‚Â¡ÃƒÆ’Ã†â€™ÃƒÂ¢Ã¢â€šÂ¬Ã…Â¡ÃƒÆ’Ã¢â‚¬Å¡Ãƒâ€šÃ‚Â¡ÃƒÆ’Ã†â€™Ãƒâ€ Ã¢â‚¬â„¢ÃƒÆ’Ã¢â‚¬Â ÃƒÂ¢Ã¢â€šÂ¬Ã¢â€žÂ¢ÃƒÆ’Ã†â€™ÃƒÂ¢Ã¢â€šÂ¬Ã‚Â ÃƒÆ’Ã‚Â¢ÃƒÂ¢Ã¢â‚¬Å¡Ã‚Â¬ÃƒÂ¢Ã¢â‚¬Å¾Ã‚Â¢ÃƒÆ’Ã†â€™Ãƒâ€ Ã¢â‚¬â„¢ÃƒÆ’Ã‚Â¢ÃƒÂ¢Ã¢â‚¬Å¡Ã‚Â¬Ãƒâ€šÃ‚Â ÃƒÆ’Ã†â€™Ãƒâ€šÃ‚Â¢ÃƒÆ’Ã‚Â¢ÃƒÂ¢Ã¢â€šÂ¬Ã…Â¡Ãƒâ€šÃ‚Â¬ÃƒÆ’Ã‚Â¢ÃƒÂ¢Ã¢â€šÂ¬Ã…Â¾Ãƒâ€šÃ‚Â¢ÃƒÆ’Ã†â€™Ãƒâ€ Ã¢â‚¬â„¢ÃƒÆ’Ã¢â‚¬Â ÃƒÂ¢Ã¢â€šÂ¬Ã¢â€žÂ¢ÃƒÆ’Ã†â€™ÃƒÂ¢Ã¢â€šÂ¬Ã…Â¡ÃƒÆ’Ã¢â‚¬Å¡Ãƒâ€šÃ‚Â¢ÃƒÆ’Ã†â€™Ãƒâ€ Ã¢â‚¬â„¢ÃƒÆ’Ã¢â‚¬Å¡Ãƒâ€šÃ‚Â¢ÃƒÆ’Ã†â€™Ãƒâ€šÃ‚Â¢ÃƒÆ’Ã‚Â¢ÃƒÂ¢Ã¢â€šÂ¬Ã…Â¡Ãƒâ€šÃ‚Â¬ÃƒÆ’Ã¢â‚¬Â¦Ãƒâ€šÃ‚Â¡ÃƒÆ’Ã†â€™ÃƒÂ¢Ã¢â€šÂ¬Ã…Â¡ÃƒÆ’Ã¢â‚¬Å¡Ãƒâ€šÃ‚Â¬ÃƒÆ’Ã†â€™Ãƒâ€ Ã¢â‚¬â„¢ÃƒÆ’Ã‚Â¢ÃƒÂ¢Ã¢â‚¬Å¡Ã‚Â¬Ãƒâ€šÃ‚Â¦ÃƒÆ’Ã†â€™ÃƒÂ¢Ã¢â€šÂ¬Ã…Â¡ÃƒÆ’Ã¢â‚¬Å¡Ãƒâ€šÃ‚Â¡ÃƒÆ’Ã†â€™Ãƒâ€ Ã¢â‚¬â„¢ÃƒÆ’Ã¢â‚¬Â ÃƒÂ¢Ã¢â€šÂ¬Ã¢â€žÂ¢ÃƒÆ’Ã†â€™ÃƒÂ¢Ã¢â€šÂ¬Ã‚Â ÃƒÆ’Ã‚Â¢ÃƒÂ¢Ã¢â‚¬Å¡Ã‚Â¬ÃƒÂ¢Ã¢â‚¬Å¾Ã‚Â¢ÃƒÆ’Ã†â€™Ãƒâ€ Ã¢â‚¬â„¢ÃƒÆ’Ã¢â‚¬Å¡Ãƒâ€šÃ‚Â¢ÃƒÆ’Ã†â€™Ãƒâ€šÃ‚Â¢ÃƒÆ’Ã‚Â¢ÃƒÂ¢Ã¢â‚¬Å¡Ã‚Â¬Ãƒâ€¦Ã‚Â¡ÃƒÆ’Ã¢â‚¬Å¡Ãƒâ€šÃ‚Â¬ÃƒÆ’Ã†â€™ÃƒÂ¢Ã¢â€šÂ¬Ã‚Â¦ÃƒÆ’Ã¢â‚¬Å¡Ãƒâ€šÃ‚Â¡ÃƒÆ’Ã†â€™Ãƒâ€ Ã¢â‚¬â„¢ÃƒÆ’Ã¢â‚¬Â ÃƒÂ¢Ã¢â€šÂ¬Ã¢â€žÂ¢ÃƒÆ’Ã†â€™Ãƒâ€šÃ‚Â¢ÃƒÆ’Ã‚Â¢ÃƒÂ¢Ã¢â€šÂ¬Ã…Â¡Ãƒâ€šÃ‚Â¬ÃƒÆ’Ã¢â‚¬Â¦Ãƒâ€šÃ‚Â¡ÃƒÆ’Ã†â€™Ãƒâ€ Ã¢â‚¬â„¢ÃƒÆ’Ã‚Â¢ÃƒÂ¢Ã¢â‚¬Å¡Ã‚Â¬Ãƒâ€¦Ã‚Â¡ÃƒÆ’Ã†â€™ÃƒÂ¢Ã¢â€šÂ¬Ã…Â¡ÃƒÆ’Ã¢â‚¬Å¡Ãƒâ€šÃ‚Â¬ÃƒÆ’Ã†â€™Ãƒâ€ Ã¢â‚¬â„¢ÃƒÆ’Ã¢â‚¬Â ÃƒÂ¢Ã¢â€šÂ¬Ã¢â€žÂ¢ÃƒÆ’Ã†â€™ÃƒÂ¢Ã¢â€šÂ¬Ã‚Â ÃƒÆ’Ã‚Â¢ÃƒÂ¢Ã¢â‚¬Å¡Ã‚Â¬ÃƒÂ¢Ã¢â‚¬Å¾Ã‚Â¢ÃƒÆ’Ã†â€™Ãƒâ€ Ã¢â‚¬â„¢ÃƒÆ’Ã‚Â¢ÃƒÂ¢Ã¢â‚¬Å¡Ã‚Â¬Ãƒâ€šÃ‚Â ÃƒÆ’Ã†â€™Ãƒâ€šÃ‚Â¢ÃƒÆ’Ã‚Â¢ÃƒÂ¢Ã¢â€šÂ¬Ã…Â¡Ãƒâ€šÃ‚Â¬ÃƒÆ’Ã‚Â¢ÃƒÂ¢Ã¢â€šÂ¬Ã…Â¾Ãƒâ€šÃ‚Â¢ÃƒÆ’Ã†â€™Ãƒâ€ Ã¢â‚¬â„¢ÃƒÆ’Ã¢â‚¬Â ÃƒÂ¢Ã¢â€šÂ¬Ã¢â€žÂ¢ÃƒÆ’Ã†â€™Ãƒâ€šÃ‚Â¢ÃƒÆ’Ã‚Â¢ÃƒÂ¢Ã¢â€šÂ¬Ã…Â¡Ãƒâ€šÃ‚Â¬ÃƒÆ’Ã¢â‚¬Å¡Ãƒâ€šÃ‚Â ÃƒÆ’Ã†â€™Ãƒâ€ Ã¢â‚¬â„¢ÃƒÆ’Ã¢â‚¬Å¡Ãƒâ€šÃ‚Â¢ÃƒÆ’Ã†â€™Ãƒâ€šÃ‚Â¢ÃƒÆ’Ã‚Â¢ÃƒÂ¢Ã¢â‚¬Å¡Ã‚Â¬Ãƒâ€¦Ã‚Â¡ÃƒÆ’Ã¢â‚¬Å¡Ãƒâ€šÃ‚Â¬ÃƒÆ’Ã†â€™Ãƒâ€šÃ‚Â¢ÃƒÆ’Ã‚Â¢ÃƒÂ¢Ã¢â‚¬Å¡Ã‚Â¬Ãƒâ€¦Ã‚Â¾ÃƒÆ’Ã¢â‚¬Å¡Ãƒâ€šÃ‚Â¢ÃƒÆ’Ã†â€™Ãƒâ€ Ã¢â‚¬â„¢ÃƒÆ’Ã¢â‚¬Â ÃƒÂ¢Ã¢â€šÂ¬Ã¢â€žÂ¢ÃƒÆ’Ã†â€™ÃƒÂ¢Ã¢â€šÂ¬Ã‚Â ÃƒÆ’Ã‚Â¢ÃƒÂ¢Ã¢â‚¬Å¡Ã‚Â¬ÃƒÂ¢Ã¢â‚¬Å¾Ã‚Â¢ÃƒÆ’Ã†â€™Ãƒâ€ Ã¢â‚¬â„¢ÃƒÆ’Ã¢â‚¬Å¡Ãƒâ€šÃ‚Â¢ÃƒÆ’Ã†â€™Ãƒâ€šÃ‚Â¢ÃƒÆ’Ã‚Â¢ÃƒÂ¢Ã¢â‚¬Å¡Ã‚Â¬Ãƒâ€¦Ã‚Â¡ÃƒÆ’Ã¢â‚¬Å¡Ãƒâ€šÃ‚Â¬ÃƒÆ’Ã†â€™ÃƒÂ¢Ã¢â€šÂ¬Ã‚Â¦ÃƒÆ’Ã¢â‚¬Å¡Ãƒâ€šÃ‚Â¡ÃƒÆ’Ã†â€™Ãƒâ€ Ã¢â‚¬â„¢ÃƒÆ’Ã¢â‚¬Â ÃƒÂ¢Ã¢â€šÂ¬Ã¢â€žÂ¢ÃƒÆ’Ã†â€™Ãƒâ€šÃ‚Â¢ÃƒÆ’Ã‚Â¢ÃƒÂ¢Ã¢â€šÂ¬Ã…Â¡Ãƒâ€šÃ‚Â¬ÃƒÆ’Ã¢â‚¬Â¦Ãƒâ€šÃ‚Â¡ÃƒÆ’Ã†â€™Ãƒâ€ Ã¢â‚¬â„¢ÃƒÆ’Ã‚Â¢ÃƒÂ¢Ã¢â‚¬Å¡Ã‚Â¬Ãƒâ€¦Ã‚Â¡ÃƒÆ’Ã†â€™ÃƒÂ¢Ã¢â€šÂ¬Ã…Â¡ÃƒÆ’Ã¢â‚¬Å¡Ãƒâ€šÃ‚Â¢ÃƒÆ’Ã†â€™Ãƒâ€ Ã¢â‚¬â„¢ÃƒÆ’Ã¢â‚¬Â ÃƒÂ¢Ã¢â€šÂ¬Ã¢â€žÂ¢ÃƒÆ’Ã†â€™ÃƒÂ¢Ã¢â€šÂ¬Ã‚Â ÃƒÆ’Ã‚Â¢ÃƒÂ¢Ã¢â‚¬Å¡Ã‚Â¬ÃƒÂ¢Ã¢â‚¬Å¾Ã‚Â¢ÃƒÆ’Ã†â€™Ãƒâ€ Ã¢â‚¬â„¢ÃƒÆ’Ã‚Â¢ÃƒÂ¢Ã¢â‚¬Å¡Ã‚Â¬Ãƒâ€šÃ‚Â ÃƒÆ’Ã†â€™Ãƒâ€šÃ‚Â¢ÃƒÆ’Ã‚Â¢ÃƒÂ¢Ã¢â€šÂ¬Ã…Â¡Ãƒâ€šÃ‚Â¬ÃƒÆ’Ã‚Â¢ÃƒÂ¢Ã¢â€šÂ¬Ã…Â¾Ãƒâ€šÃ‚Â¢ÃƒÆ’Ã†â€™Ãƒâ€ Ã¢â‚¬â„¢ÃƒÆ’Ã¢â‚¬Â ÃƒÂ¢Ã¢â€šÂ¬Ã¢â€žÂ¢ÃƒÆ’Ã†â€™Ãƒâ€šÃ‚Â¢ÃƒÆ’Ã‚Â¢ÃƒÂ¢Ã¢â€šÂ¬Ã…Â¡Ãƒâ€šÃ‚Â¬ÃƒÆ’Ã¢â‚¬Â¦Ãƒâ€šÃ‚Â¡ÃƒÆ’Ã†â€™Ãƒâ€ Ã¢â‚¬â„¢ÃƒÆ’Ã‚Â¢ÃƒÂ¢Ã¢â‚¬Å¡Ã‚Â¬Ãƒâ€¦Ã‚Â¡ÃƒÆ’Ã†â€™ÃƒÂ¢Ã¢â€šÂ¬Ã…Â¡ÃƒÆ’Ã¢â‚¬Å¡Ãƒâ€šÃ‚Â¢ÃƒÆ’Ã†â€™Ãƒâ€ Ã¢â‚¬â„¢ÃƒÆ’Ã¢â‚¬Â ÃƒÂ¢Ã¢â€šÂ¬Ã¢â€žÂ¢ÃƒÆ’Ã†â€™ÃƒÂ¢Ã¢â€šÂ¬Ã‚Â ÃƒÆ’Ã‚Â¢ÃƒÂ¢Ã¢â‚¬Å¡Ã‚Â¬ÃƒÂ¢Ã¢â‚¬Å¾Ã‚Â¢ÃƒÆ’Ã†â€™Ãƒâ€ Ã¢â‚¬â„¢ÃƒÆ’Ã‚Â¢ÃƒÂ¢Ã¢â‚¬Å¡Ã‚Â¬Ãƒâ€¦Ã‚Â¡ÃƒÆ’Ã†â€™ÃƒÂ¢Ã¢â€šÂ¬Ã…Â¡ÃƒÆ’Ã¢â‚¬Å¡Ãƒâ€šÃ‚Â¢ÃƒÆ’Ã†â€™Ãƒâ€ Ã¢â‚¬â„¢ÃƒÆ’Ã¢â‚¬Â ÃƒÂ¢Ã¢â€šÂ¬Ã¢â€žÂ¢ÃƒÆ’Ã†â€™ÃƒÂ¢Ã¢â€šÂ¬Ã…Â¡ÃƒÆ’Ã¢â‚¬Å¡Ãƒâ€šÃ‚Â¢ÃƒÆ’Ã†â€™Ãƒâ€ Ã¢â‚¬â„¢ÃƒÆ’Ã¢â‚¬Å¡Ãƒâ€šÃ‚Â¢ÃƒÆ’Ã†â€™Ãƒâ€šÃ‚Â¢ÃƒÆ’Ã‚Â¢ÃƒÂ¢Ã¢â‚¬Å¡Ã‚Â¬Ãƒâ€¦Ã‚Â¡ÃƒÆ’Ã¢â‚¬Å¡Ãƒâ€šÃ‚Â¬ÃƒÆ’Ã†â€™ÃƒÂ¢Ã¢â€šÂ¬Ã‚Â¦ÃƒÆ’Ã¢â‚¬Å¡Ãƒâ€šÃ‚Â¡ÃƒÆ’Ã†â€™Ãƒâ€ Ã¢â‚¬â„¢ÃƒÆ’Ã‚Â¢ÃƒÂ¢Ã¢â‚¬Å¡Ã‚Â¬Ãƒâ€¦Ã‚Â¡ÃƒÆ’Ã†â€™ÃƒÂ¢Ã¢â€šÂ¬Ã…Â¡ÃƒÆ’Ã¢â‚¬Å¡Ãƒâ€šÃ‚Â¬ÃƒÆ’Ã†â€™Ãƒâ€ Ã¢â‚¬â„¢ÃƒÆ’Ã¢â‚¬Â ÃƒÂ¢Ã¢â€šÂ¬Ã¢â€žÂ¢ÃƒÆ’Ã†â€™Ãƒâ€šÃ‚Â¢ÃƒÆ’Ã‚Â¢ÃƒÂ¢Ã¢â€šÂ¬Ã…Â¡Ãƒâ€šÃ‚Â¬ÃƒÆ’Ã¢â‚¬Å¡Ãƒâ€šÃ‚Â¦ÃƒÆ’Ã†â€™Ãƒâ€ Ã¢â‚¬â„¢ÃƒÆ’Ã‚Â¢ÃƒÂ¢Ã¢â‚¬Å¡Ã‚Â¬Ãƒâ€¦Ã‚Â¡ÃƒÆ’Ã†â€™ÃƒÂ¢Ã¢â€šÂ¬Ã…Â¡ÃƒÆ’Ã¢â‚¬Å¡Ãƒâ€šÃ‚Â¡ÃƒÆ’Ã†â€™Ãƒâ€ Ã¢â‚¬â„¢ÃƒÆ’Ã¢â‚¬Â ÃƒÂ¢Ã¢â€šÂ¬Ã¢â€žÂ¢ÃƒÆ’Ã†â€™ÃƒÂ¢Ã¢â€šÂ¬Ã‚Â ÃƒÆ’Ã‚Â¢ÃƒÂ¢Ã¢â‚¬Å¡Ã‚Â¬ÃƒÂ¢Ã¢â‚¬Å¾Ã‚Â¢ÃƒÆ’Ã†â€™Ãƒâ€ Ã¢â‚¬â„¢ÃƒÆ’Ã¢â‚¬Å¡Ãƒâ€šÃ‚Â¢ÃƒÆ’Ã†â€™Ãƒâ€šÃ‚Â¢ÃƒÆ’Ã‚Â¢ÃƒÂ¢Ã¢â‚¬Å¡Ã‚Â¬Ãƒâ€¦Ã‚Â¡ÃƒÆ’Ã¢â‚¬Å¡Ãƒâ€šÃ‚Â¬ÃƒÆ’Ã†â€™ÃƒÂ¢Ã¢â€šÂ¬Ã‚Â¦ÃƒÆ’Ã¢â‚¬Å¡Ãƒâ€šÃ‚Â¡ÃƒÆ’Ã†â€™Ãƒâ€ Ã¢â‚¬â„¢ÃƒÆ’Ã¢â‚¬Â ÃƒÂ¢Ã¢â€šÂ¬Ã¢â€žÂ¢ÃƒÆ’Ã†â€™Ãƒâ€šÃ‚Â¢ÃƒÆ’Ã‚Â¢ÃƒÂ¢Ã¢â€šÂ¬Ã…Â¡Ãƒâ€šÃ‚Â¬ÃƒÆ’Ã¢â‚¬Â¦Ãƒâ€šÃ‚Â¡ÃƒÆ’Ã†â€™Ãƒâ€ Ã¢â‚¬â„¢ÃƒÆ’Ã‚Â¢ÃƒÂ¢Ã¢â‚¬Å¡Ã‚Â¬Ãƒâ€¦Ã‚Â¡ÃƒÆ’Ã†â€™ÃƒÂ¢Ã¢â€šÂ¬Ã…Â¡ÃƒÆ’Ã¢â‚¬Å¡Ãƒâ€šÃ‚Â¬ÃƒÆ’Ã†â€™Ãƒâ€ Ã¢â‚¬â„¢ÃƒÆ’Ã¢â‚¬Â ÃƒÂ¢Ã¢â€šÂ¬Ã¢â€žÂ¢ÃƒÆ’Ã†â€™ÃƒÂ¢Ã¢â€šÂ¬Ã‚Â ÃƒÆ’Ã‚Â¢ÃƒÂ¢Ã¢â‚¬Å¡Ã‚Â¬ÃƒÂ¢Ã¢â‚¬Å¾Ã‚Â¢ÃƒÆ’Ã†â€™Ãƒâ€ Ã¢â‚¬â„¢ÃƒÆ’Ã‚Â¢ÃƒÂ¢Ã¢â‚¬Å¡Ã‚Â¬Ãƒâ€šÃ‚Â ÃƒÆ’Ã†â€™Ãƒâ€šÃ‚Â¢ÃƒÆ’Ã‚Â¢ÃƒÂ¢Ã¢â€šÂ¬Ã…Â¡Ãƒâ€šÃ‚Â¬ÃƒÆ’Ã‚Â¢ÃƒÂ¢Ã¢â€šÂ¬Ã…Â¾Ãƒâ€šÃ‚Â¢ÃƒÆ’Ã†â€™Ãƒâ€ Ã¢â‚¬â„¢ÃƒÆ’Ã¢â‚¬Â ÃƒÂ¢Ã¢â€šÂ¬Ã¢â€žÂ¢ÃƒÆ’Ã†â€™ÃƒÂ¢Ã¢â€šÂ¬Ã…Â¡ÃƒÆ’Ã¢â‚¬Å¡Ãƒâ€šÃ‚Â¢ÃƒÆ’Ã†â€™Ãƒâ€ Ã¢â‚¬â„¢ÃƒÆ’Ã¢â‚¬Å¡Ãƒâ€šÃ‚Â¢ÃƒÆ’Ã†â€™Ãƒâ€šÃ‚Â¢ÃƒÆ’Ã‚Â¢ÃƒÂ¢Ã¢â€šÂ¬Ã…Â¡Ãƒâ€šÃ‚Â¬ÃƒÆ’Ã¢â‚¬Â¦Ãƒâ€šÃ‚Â¡ÃƒÆ’Ã†â€™ÃƒÂ¢Ã¢â€šÂ¬Ã…Â¡ÃƒÆ’Ã¢â‚¬Å¡Ãƒâ€šÃ‚Â¬ÃƒÆ’Ã†â€™Ãƒâ€ Ã¢â‚¬â„¢ÃƒÆ’Ã‚Â¢ÃƒÂ¢Ã¢â‚¬Å¡Ã‚Â¬Ãƒâ€¦Ã‚Â¡ÃƒÆ’Ã†â€™ÃƒÂ¢Ã¢â€šÂ¬Ã…Â¡ÃƒÆ’Ã¢â‚¬Å¡Ãƒâ€šÃ‚Â¦ÃƒÆ’Ã†â€™Ãƒâ€ Ã¢â‚¬â„¢ÃƒÆ’Ã¢â‚¬Â ÃƒÂ¢Ã¢â€šÂ¬Ã¢â€žÂ¢ÃƒÆ’Ã†â€™ÃƒÂ¢Ã¢â€šÂ¬Ã‚Â ÃƒÆ’Ã‚Â¢ÃƒÂ¢Ã¢â‚¬Å¡Ã‚Â¬ÃƒÂ¢Ã¢â‚¬Å¾Ã‚Â¢ÃƒÆ’Ã†â€™Ãƒâ€ Ã¢â‚¬â„¢ÃƒÆ’Ã‚Â¢ÃƒÂ¢Ã¢â‚¬Å¡Ã‚Â¬Ãƒâ€¦Ã‚Â¡ÃƒÆ’Ã†â€™ÃƒÂ¢Ã¢â€šÂ¬Ã…Â¡ÃƒÆ’Ã¢â‚¬Å¡Ãƒâ€šÃ‚Â¢ÃƒÆ’Ã†â€™Ãƒâ€ Ã¢â‚¬â„¢ÃƒÆ’Ã¢â‚¬Â ÃƒÂ¢Ã¢â€šÂ¬Ã¢â€žÂ¢ÃƒÆ’Ã†â€™ÃƒÂ¢Ã¢â€šÂ¬Ã…Â¡ÃƒÆ’Ã¢â‚¬Å¡Ãƒâ€šÃ‚Â¢ÃƒÆ’Ã†â€™Ãƒâ€ Ã¢â‚¬â„¢ÃƒÆ’Ã¢â‚¬Å¡Ãƒâ€šÃ‚Â¢ÃƒÆ’Ã†â€™Ãƒâ€šÃ‚Â¢ÃƒÆ’Ã‚Â¢ÃƒÂ¢Ã¢â‚¬Å¡Ã‚Â¬Ãƒâ€¦Ã‚Â¡ÃƒÆ’Ã¢â‚¬Å¡Ãƒâ€šÃ‚Â¬ÃƒÆ’Ã†â€™ÃƒÂ¢Ã¢â€šÂ¬Ã‚Â¦ÃƒÆ’Ã¢â‚¬Å¡Ãƒâ€šÃ‚Â¡ÃƒÆ’Ã†â€™Ãƒâ€ Ã¢â‚¬â„¢ÃƒÆ’Ã‚Â¢ÃƒÂ¢Ã¢â‚¬Å¡Ã‚Â¬Ãƒâ€¦Ã‚Â¡ÃƒÆ’Ã†â€™ÃƒÂ¢Ã¢â€šÂ¬Ã…Â¡ÃƒÆ’Ã¢â‚¬Å¡Ãƒâ€šÃ‚Â¬ÃƒÆ’Ã†â€™Ãƒâ€ Ã¢â‚¬â„¢ÃƒÆ’Ã¢â‚¬Â ÃƒÂ¢Ã¢â€šÂ¬Ã¢â€žÂ¢ÃƒÆ’Ã†â€™Ãƒâ€šÃ‚Â¢ÃƒÆ’Ã‚Â¢ÃƒÂ¢Ã¢â€šÂ¬Ã…Â¡Ãƒâ€šÃ‚Â¬ÃƒÆ’Ã¢â‚¬Å¡Ãƒâ€šÃ‚Â¦ÃƒÆ’Ã†â€™Ãƒâ€ Ã¢â‚¬â„¢ÃƒÆ’Ã¢â‚¬Å¡Ãƒâ€šÃ‚Â¢ÃƒÆ’Ã†â€™Ãƒâ€šÃ‚Â¢ÃƒÆ’Ã‚Â¢ÃƒÂ¢Ã¢â‚¬Å¡Ã‚Â¬Ãƒâ€¦Ã‚Â¡ÃƒÆ’Ã¢â‚¬Å¡Ãƒâ€šÃ‚Â¬ÃƒÆ’Ã†â€™ÃƒÂ¢Ã¢â€šÂ¬Ã‚Â¦ÃƒÆ’Ã‚Â¢ÃƒÂ¢Ã¢â‚¬Å¡Ã‚Â¬Ãƒâ€¦Ã¢â‚¬Å“Wk3), both systems recorded negative growth, with the IMTA group showing a slightly greater decline (-1.977%/day) compared to Monoculture (-0.985%/day). In the subsequent phase (Wk3ÃƒÆ’Ã†â€™Ãƒâ€ Ã¢â‚¬â„¢ÃƒÆ’Ã¢â‚¬Â ÃƒÂ¢Ã¢â€šÂ¬Ã¢â€žÂ¢ÃƒÆ’Ã†â€™ÃƒÂ¢Ã¢â€šÂ¬Ã‚Â ÃƒÆ’Ã‚Â¢ÃƒÂ¢Ã¢â‚¬Å¡Ã‚Â¬ÃƒÂ¢Ã¢â‚¬Å¾Ã‚Â¢ÃƒÆ’Ã†â€™Ãƒâ€ Ã¢â‚¬â„¢ÃƒÆ’Ã‚Â¢ÃƒÂ¢Ã¢â‚¬Å¡Ã‚Â¬Ãƒâ€šÃ‚Â ÃƒÆ’Ã†â€™Ãƒâ€šÃ‚Â¢ÃƒÆ’Ã‚Â¢ÃƒÂ¢Ã¢â€šÂ¬Ã…Â¡Ãƒâ€šÃ‚Â¬ÃƒÆ’Ã‚Â¢ÃƒÂ¢Ã¢â€šÂ¬Ã…Â¾Ãƒâ€šÃ‚Â¢ÃƒÆ’Ã†â€™Ãƒâ€ Ã¢â‚¬â„¢ÃƒÆ’Ã¢â‚¬Â ÃƒÂ¢Ã¢â€šÂ¬Ã¢â€žÂ¢ÃƒÆ’Ã†â€™Ãƒâ€šÃ‚Â¢ÃƒÆ’Ã‚Â¢ÃƒÂ¢Ã¢â€šÂ¬Ã…Â¡Ãƒâ€šÃ‚Â¬ÃƒÆ’Ã¢â‚¬Å¡Ãƒâ€šÃ‚Â ÃƒÆ’Ã†â€™Ãƒâ€ Ã¢â‚¬â„¢ÃƒÆ’Ã¢â‚¬Å¡Ãƒâ€šÃ‚Â¢ÃƒÆ’Ã†â€™Ãƒâ€šÃ‚Â¢ÃƒÆ’Ã‚Â¢ÃƒÂ¢Ã¢â‚¬Å¡Ã‚Â¬Ãƒâ€¦Ã‚Â¡ÃƒÆ’Ã¢â‚¬Å¡Ãƒâ€šÃ‚Â¬ÃƒÆ’Ã†â€™Ãƒâ€šÃ‚Â¢ÃƒÆ’Ã‚Â¢ÃƒÂ¢Ã¢â‚¬Å¡Ã‚Â¬Ãƒâ€¦Ã‚Â¾ÃƒÆ’Ã¢â‚¬Å¡Ãƒâ€šÃ‚Â¢ÃƒÆ’Ã†â€™Ãƒâ€ Ã¢â‚¬â„¢ÃƒÆ’Ã¢â‚¬Â ÃƒÂ¢Ã¢â€šÂ¬Ã¢â€žÂ¢ÃƒÆ’Ã†â€™ÃƒÂ¢Ã¢â€šÂ¬Ã‚Â ÃƒÆ’Ã‚Â¢ÃƒÂ¢Ã¢â‚¬Å¡Ã‚Â¬ÃƒÂ¢Ã¢â‚¬Å¾Ã‚Â¢ÃƒÆ’Ã†â€™Ãƒâ€ Ã¢â‚¬â„¢ÃƒÆ’Ã¢â‚¬Å¡Ãƒâ€šÃ‚Â¢ÃƒÆ’Ã†â€™Ãƒâ€šÃ‚Â¢ÃƒÆ’Ã‚Â¢ÃƒÂ¢Ã¢â‚¬Å¡Ã‚Â¬Ãƒâ€¦Ã‚Â¡ÃƒÆ’Ã¢â‚¬Å¡Ãƒâ€šÃ‚Â¬ÃƒÆ’Ã†â€™ÃƒÂ¢Ã¢â€šÂ¬Ã…Â¡ÃƒÆ’Ã¢â‚¬Å¡Ãƒâ€šÃ‚Â ÃƒÆ’Ã†â€™Ãƒâ€ Ã¢â‚¬â„¢ÃƒÆ’Ã¢â‚¬Â ÃƒÂ¢Ã¢â€šÂ¬Ã¢â€žÂ¢ÃƒÆ’Ã†â€™ÃƒÂ¢Ã¢â€šÂ¬Ã…Â¡ÃƒÆ’Ã¢â‚¬Å¡Ãƒâ€šÃ‚Â¢ÃƒÆ’Ã†â€™Ãƒâ€ Ã¢â‚¬â„¢ÃƒÆ’Ã¢â‚¬Å¡Ãƒâ€šÃ‚Â¢ÃƒÆ’Ã†â€™Ãƒâ€šÃ‚Â¢ÃƒÆ’Ã‚Â¢ÃƒÂ¢Ã¢â€šÂ¬Ã…Â¡Ãƒâ€šÃ‚Â¬ÃƒÆ’Ã¢â‚¬Â¦Ãƒâ€šÃ‚Â¡ÃƒÆ’Ã†â€™ÃƒÂ¢Ã¢â€šÂ¬Ã…Â¡ÃƒÆ’Ã¢â‚¬Å¡Ãƒâ€šÃ‚Â¬ÃƒÆ’Ã†â€™Ãƒâ€ Ã¢â‚¬â„¢ÃƒÆ’Ã¢â‚¬Å¡Ãƒâ€šÃ‚Â¢ÃƒÆ’Ã†â€™Ãƒâ€šÃ‚Â¢ÃƒÆ’Ã‚Â¢ÃƒÂ¢Ã¢â€šÂ¬Ã…Â¡Ãƒâ€šÃ‚Â¬ÃƒÆ’Ã¢â‚¬Â¦Ãƒâ€šÃ‚Â¾ÃƒÆ’Ã†â€™ÃƒÂ¢Ã¢â€šÂ¬Ã…Â¡ÃƒÆ’Ã¢â‚¬Å¡Ãƒâ€šÃ‚Â¢ÃƒÆ’Ã†â€™Ãƒâ€ Ã¢â‚¬â„¢ÃƒÆ’Ã¢â‚¬Â ÃƒÂ¢Ã¢â€šÂ¬Ã¢â€žÂ¢ÃƒÆ’Ã†â€™ÃƒÂ¢Ã¢â€šÂ¬Ã‚Â ÃƒÆ’Ã‚Â¢ÃƒÂ¢Ã¢â‚¬Å¡Ã‚Â¬ÃƒÂ¢Ã¢â‚¬Å¾Ã‚Â¢ÃƒÆ’Ã†â€™Ãƒâ€ Ã¢â‚¬â„¢ÃƒÆ’Ã‚Â¢ÃƒÂ¢Ã¢â‚¬Å¡Ã‚Â¬Ãƒâ€šÃ‚Â ÃƒÆ’Ã†â€™Ãƒâ€šÃ‚Â¢ÃƒÆ’Ã‚Â¢ÃƒÂ¢Ã¢â€šÂ¬Ã…Â¡Ãƒâ€šÃ‚Â¬ÃƒÆ’Ã‚Â¢ÃƒÂ¢Ã¢â€šÂ¬Ã…Â¾Ãƒâ€šÃ‚Â¢ÃƒÆ’Ã†â€™Ãƒâ€ Ã¢â‚¬â„¢ÃƒÆ’Ã¢â‚¬Â ÃƒÂ¢Ã¢â€šÂ¬Ã¢â€žÂ¢ÃƒÆ’Ã†â€™ÃƒÂ¢Ã¢â€šÂ¬Ã…Â¡ÃƒÆ’Ã¢â‚¬Å¡Ãƒâ€šÃ‚Â¢ÃƒÆ’Ã†â€™Ãƒâ€ Ã¢â‚¬â„¢ÃƒÆ’Ã¢â‚¬Å¡Ãƒâ€šÃ‚Â¢ÃƒÆ’Ã†â€™Ãƒâ€šÃ‚Â¢ÃƒÆ’Ã‚Â¢ÃƒÂ¢Ã¢â€šÂ¬Ã…Â¡Ãƒâ€šÃ‚Â¬ÃƒÆ’Ã¢â‚¬Â¦Ãƒâ€šÃ‚Â¡ÃƒÆ’Ã†â€™ÃƒÂ¢Ã¢â€šÂ¬Ã…Â¡ÃƒÆ’Ã¢â‚¬Å¡Ãƒâ€šÃ‚Â¬ÃƒÆ’Ã†â€™Ãƒâ€ Ã¢â‚¬â„¢ÃƒÆ’Ã‚Â¢ÃƒÂ¢Ã¢â‚¬Å¡Ã‚Â¬Ãƒâ€šÃ‚Â¦ÃƒÆ’Ã†â€™ÃƒÂ¢Ã¢â€šÂ¬Ã…Â¡ÃƒÆ’Ã¢â‚¬Å¡Ãƒâ€šÃ‚Â¡ÃƒÆ’Ã†â€™Ãƒâ€ Ã¢â‚¬â„¢ÃƒÆ’Ã¢â‚¬Â ÃƒÂ¢Ã¢â€šÂ¬Ã¢â€žÂ¢ÃƒÆ’Ã†â€™ÃƒÂ¢Ã¢â€šÂ¬Ã‚Â ÃƒÆ’Ã‚Â¢ÃƒÂ¢Ã¢â‚¬Å¡Ã‚Â¬ÃƒÂ¢Ã¢â‚¬Å¾Ã‚Â¢ÃƒÆ’Ã†â€™Ãƒâ€ Ã¢â‚¬â„¢ÃƒÆ’Ã¢â‚¬Å¡Ãƒâ€šÃ‚Â¢ÃƒÆ’Ã†â€™Ãƒâ€šÃ‚Â¢ÃƒÆ’Ã‚Â¢ÃƒÂ¢Ã¢â‚¬Å¡Ã‚Â¬Ãƒâ€¦Ã‚Â¡ÃƒÆ’Ã¢â‚¬Å¡Ãƒâ€šÃ‚Â¬ÃƒÆ’Ã†â€™ÃƒÂ¢Ã¢â€šÂ¬Ã‚Â¦ÃƒÆ’Ã¢â‚¬Å¡Ãƒâ€šÃ‚Â¡ÃƒÆ’Ã†â€™Ãƒâ€ Ã¢â‚¬â„¢ÃƒÆ’Ã¢â‚¬Â ÃƒÂ¢Ã¢â€šÂ¬Ã¢â€žÂ¢ÃƒÆ’Ã†â€™Ãƒâ€šÃ‚Â¢ÃƒÆ’Ã‚Â¢ÃƒÂ¢Ã¢â€šÂ¬Ã…Â¡Ãƒâ€šÃ‚Â¬ÃƒÆ’Ã¢â‚¬Â¦Ãƒâ€šÃ‚Â¡ÃƒÆ’Ã†â€™Ãƒâ€ Ã¢â‚¬â„¢ÃƒÆ’Ã‚Â¢ÃƒÂ¢Ã¢â‚¬Å¡Ã‚Â¬Ãƒâ€¦Ã‚Â¡ÃƒÆ’Ã†â€™ÃƒÂ¢Ã¢â€šÂ¬Ã…Â¡ÃƒÆ’Ã¢â‚¬Å¡Ãƒâ€šÃ‚Â¢ÃƒÆ’Ã†â€™Ãƒâ€ Ã¢â‚¬â„¢ÃƒÆ’Ã¢â‚¬Â ÃƒÂ¢Ã¢â€šÂ¬Ã¢â€žÂ¢ÃƒÆ’Ã†â€™ÃƒÂ¢Ã¢â€šÂ¬Ã‚Â ÃƒÆ’Ã‚Â¢ÃƒÂ¢Ã¢â‚¬Å¡Ã‚Â¬ÃƒÂ¢Ã¢â‚¬Å¾Ã‚Â¢ÃƒÆ’Ã†â€™Ãƒâ€ Ã¢â‚¬â„¢ÃƒÆ’Ã‚Â¢ÃƒÂ¢Ã¢â‚¬Å¡Ã‚Â¬Ãƒâ€šÃ‚Â ÃƒÆ’Ã†â€™Ãƒâ€šÃ‚Â¢ÃƒÆ’Ã‚Â¢ÃƒÂ¢Ã¢â€šÂ¬Ã…Â¡Ãƒâ€šÃ‚Â¬ÃƒÆ’Ã‚Â¢ÃƒÂ¢Ã¢â€šÂ¬Ã…Â¾Ãƒâ€šÃ‚Â¢ÃƒÆ’Ã†â€™Ãƒâ€ Ã¢â‚¬â„¢ÃƒÆ’Ã¢â‚¬Â ÃƒÂ¢Ã¢â€šÂ¬Ã¢â€žÂ¢ÃƒÆ’Ã†â€™Ãƒâ€šÃ‚Â¢ÃƒÆ’Ã‚Â¢ÃƒÂ¢Ã¢â€šÂ¬Ã…Â¡Ãƒâ€šÃ‚Â¬ÃƒÆ’Ã¢â‚¬Å¡Ãƒâ€šÃ‚Â ÃƒÆ’Ã†â€™Ãƒâ€ Ã¢â‚¬â„¢ÃƒÆ’Ã¢â‚¬Å¡Ãƒâ€šÃ‚Â¢ÃƒÆ’Ã†â€™Ãƒâ€šÃ‚Â¢ÃƒÆ’Ã‚Â¢ÃƒÂ¢Ã¢â‚¬Å¡Ã‚Â¬Ãƒâ€¦Ã‚Â¡ÃƒÆ’Ã¢â‚¬Å¡Ãƒâ€šÃ‚Â¬ÃƒÆ’Ã†â€™Ãƒâ€šÃ‚Â¢ÃƒÆ’Ã‚Â¢ÃƒÂ¢Ã¢â‚¬Å¡Ã‚Â¬Ãƒâ€¦Ã‚Â¾ÃƒÆ’Ã¢â‚¬Å¡Ãƒâ€šÃ‚Â¢ÃƒÆ’Ã†â€™Ãƒâ€ Ã¢â‚¬â„¢ÃƒÆ’Ã¢â‚¬Â ÃƒÂ¢Ã¢â€šÂ¬Ã¢â€žÂ¢ÃƒÆ’Ã†â€™ÃƒÂ¢Ã¢â€šÂ¬Ã‚Â ÃƒÆ’Ã‚Â¢ÃƒÂ¢Ã¢â‚¬Å¡Ã‚Â¬ÃƒÂ¢Ã¢â‚¬Å¾Ã‚Â¢ÃƒÆ’Ã†â€™Ãƒâ€ Ã¢â‚¬â„¢ÃƒÆ’Ã¢â‚¬Å¡Ãƒâ€šÃ‚Â¢ÃƒÆ’Ã†â€™Ãƒâ€šÃ‚Â¢ÃƒÆ’Ã‚Â¢ÃƒÂ¢Ã¢â‚¬Å¡Ã‚Â¬Ãƒâ€¦Ã‚Â¡ÃƒÆ’Ã¢â‚¬Å¡Ãƒâ€šÃ‚Â¬ÃƒÆ’Ã†â€™ÃƒÂ¢Ã¢â€šÂ¬Ã‚Â¦ÃƒÆ’Ã¢â‚¬Å¡Ãƒâ€šÃ‚Â¡ÃƒÆ’Ã†â€™Ãƒâ€ Ã¢â‚¬â„¢ÃƒÆ’Ã¢â‚¬Â ÃƒÂ¢Ã¢â€šÂ¬Ã¢â€žÂ¢ÃƒÆ’Ã†â€™Ãƒâ€šÃ‚Â¢ÃƒÆ’Ã‚Â¢ÃƒÂ¢Ã¢â€šÂ¬Ã…Â¡Ãƒâ€šÃ‚Â¬ÃƒÆ’Ã¢â‚¬Â¦Ãƒâ€šÃ‚Â¡ÃƒÆ’Ã†â€™Ãƒâ€ Ã¢â‚¬â„¢ÃƒÆ’Ã‚Â¢ÃƒÂ¢Ã¢â‚¬Å¡Ã‚Â¬Ãƒâ€¦Ã‚Â¡ÃƒÆ’Ã†â€™ÃƒÂ¢Ã¢â€šÂ¬Ã…Â¡ÃƒÆ’Ã¢â‚¬Å¡Ãƒâ€šÃ‚Â¢ÃƒÆ’Ã†â€™Ãƒâ€ Ã¢â‚¬â„¢ÃƒÆ’Ã¢â‚¬Â ÃƒÂ¢Ã¢â€šÂ¬Ã¢â€žÂ¢ÃƒÆ’Ã†â€™ÃƒÂ¢Ã¢â€šÂ¬Ã‚Â ÃƒÆ’Ã‚Â¢ÃƒÂ¢Ã¢â‚¬Å¡Ã‚Â¬ÃƒÂ¢Ã¢â‚¬Å¾Ã‚Â¢ÃƒÆ’Ã†â€™Ãƒâ€ Ã¢â‚¬â„¢ÃƒÆ’Ã‚Â¢ÃƒÂ¢Ã¢â‚¬Å¡Ã‚Â¬Ãƒâ€šÃ‚Â ÃƒÆ’Ã†â€™Ãƒâ€šÃ‚Â¢ÃƒÆ’Ã‚Â¢ÃƒÂ¢Ã¢â€šÂ¬Ã…Â¡Ãƒâ€šÃ‚Â¬ÃƒÆ’Ã‚Â¢ÃƒÂ¢Ã¢â€šÂ¬Ã…Â¾Ãƒâ€šÃ‚Â¢ÃƒÆ’Ã†â€™Ãƒâ€ Ã¢â‚¬â„¢ÃƒÆ’Ã¢â‚¬Â ÃƒÂ¢Ã¢â€šÂ¬Ã¢â€žÂ¢ÃƒÆ’Ã†â€™Ãƒâ€šÃ‚Â¢ÃƒÆ’Ã‚Â¢ÃƒÂ¢Ã¢â€šÂ¬Ã…Â¡Ãƒâ€šÃ‚Â¬ÃƒÆ’Ã¢â‚¬Â¦Ãƒâ€šÃ‚Â¡ÃƒÆ’Ã†â€™Ãƒâ€ Ã¢â‚¬â„¢ÃƒÆ’Ã‚Â¢ÃƒÂ¢Ã¢â‚¬Å¡Ã‚Â¬Ãƒâ€¦Ã‚Â¡ÃƒÆ’Ã†â€™ÃƒÂ¢Ã¢â€šÂ¬Ã…Â¡ÃƒÆ’Ã¢â‚¬Å¡Ãƒâ€šÃ‚Â¢ÃƒÆ’Ã†â€™Ãƒâ€ Ã¢â‚¬â„¢ÃƒÆ’Ã¢â‚¬Â ÃƒÂ¢Ã¢â€šÂ¬Ã¢â€žÂ¢ÃƒÆ’Ã†â€™ÃƒÂ¢Ã¢â€šÂ¬Ã‚Â ÃƒÆ’Ã‚Â¢ÃƒÂ¢Ã¢â‚¬Å¡Ã‚Â¬ÃƒÂ¢Ã¢â‚¬Å¾Ã‚Â¢ÃƒÆ’Ã†â€™Ãƒâ€ Ã¢â‚¬â„¢ÃƒÆ’Ã‚Â¢ÃƒÂ¢Ã¢â‚¬Å¡Ã‚Â¬Ãƒâ€¦Ã‚Â¡ÃƒÆ’Ã†â€™ÃƒÂ¢Ã¢â€šÂ¬Ã…Â¡ÃƒÆ’Ã¢â‚¬Å¡Ãƒâ€šÃ‚Â¢ÃƒÆ’Ã†â€™Ãƒâ€ Ã¢â‚¬â„¢ÃƒÆ’Ã¢â‚¬Â ÃƒÂ¢Ã¢â€šÂ¬Ã¢â€žÂ¢ÃƒÆ’Ã†â€™ÃƒÂ¢Ã¢â€šÂ¬Ã…Â¡ÃƒÆ’Ã¢â‚¬Å¡Ãƒâ€šÃ‚Â¢ÃƒÆ’Ã†â€™Ãƒâ€ Ã¢â‚¬â„¢ÃƒÆ’Ã¢â‚¬Å¡Ãƒâ€šÃ‚Â¢ÃƒÆ’Ã†â€™Ãƒâ€šÃ‚Â¢ÃƒÆ’Ã‚Â¢ÃƒÂ¢Ã¢â€šÂ¬Ã…Â¡Ãƒâ€šÃ‚Â¬ÃƒÆ’Ã¢â‚¬Â¦Ãƒâ€šÃ‚Â¡ÃƒÆ’Ã†â€™ÃƒÂ¢Ã¢â€šÂ¬Ã…Â¡ÃƒÆ’Ã¢â‚¬Å¡Ãƒâ€šÃ‚Â¬ÃƒÆ’Ã†â€™Ãƒâ€ Ã¢â‚¬â„¢ÃƒÆ’Ã‚Â¢ÃƒÂ¢Ã¢â‚¬Å¡Ã‚Â¬Ãƒâ€šÃ‚Â¦ÃƒÆ’Ã†â€™ÃƒÂ¢Ã¢â€šÂ¬Ã…Â¡ÃƒÆ’Ã¢â‚¬Å¡Ãƒâ€šÃ‚Â¡ÃƒÆ’Ã†â€™Ãƒâ€ Ã¢â‚¬â„¢ÃƒÆ’Ã¢â‚¬Â ÃƒÂ¢Ã¢â€šÂ¬Ã¢â€žÂ¢ÃƒÆ’Ã†â€™Ãƒâ€šÃ‚Â¢ÃƒÆ’Ã‚Â¢ÃƒÂ¢Ã¢â€šÂ¬Ã…Â¡Ãƒâ€šÃ‚Â¬ÃƒÆ’Ã¢â‚¬Â¦Ãƒâ€šÃ‚Â¡ÃƒÆ’Ã†â€™Ãƒâ€ Ã¢â‚¬â„¢ÃƒÆ’Ã‚Â¢ÃƒÂ¢Ã¢â‚¬Å¡Ã‚Â¬Ãƒâ€¦Ã‚Â¡ÃƒÆ’Ã†â€™ÃƒÂ¢Ã¢â€šÂ¬Ã…Â¡ÃƒÆ’Ã¢â‚¬Å¡Ãƒâ€šÃ‚Â¬ÃƒÆ’Ã†â€™Ãƒâ€ Ã¢â‚¬â„¢ÃƒÆ’Ã¢â‚¬Â ÃƒÂ¢Ã¢â€šÂ¬Ã¢â€žÂ¢ÃƒÆ’Ã†â€™ÃƒÂ¢Ã¢â€šÂ¬Ã‚Â ÃƒÆ’Ã‚Â¢ÃƒÂ¢Ã¢â‚¬Å¡Ã‚Â¬ÃƒÂ¢Ã¢â‚¬Å¾Ã‚Â¢ÃƒÆ’Ã†â€™Ãƒâ€ Ã¢â‚¬â„¢ÃƒÆ’Ã¢â‚¬Å¡Ãƒâ€šÃ‚Â¢ÃƒÆ’Ã†â€™Ãƒâ€šÃ‚Â¢ÃƒÆ’Ã‚Â¢ÃƒÂ¢Ã¢â‚¬Å¡Ã‚Â¬Ãƒâ€¦Ã‚Â¡ÃƒÆ’Ã¢â‚¬Å¡Ãƒâ€šÃ‚Â¬ÃƒÆ’Ã†â€™ÃƒÂ¢Ã¢â€šÂ¬Ã…Â¡ÃƒÆ’Ã¢â‚¬Å¡Ãƒâ€šÃ‚Â¦ÃƒÆ’Ã†â€™Ãƒâ€ Ã¢â‚¬â„¢ÃƒÆ’Ã¢â‚¬Â ÃƒÂ¢Ã¢â€šÂ¬Ã¢â€žÂ¢ÃƒÆ’Ã†â€™Ãƒâ€šÃ‚Â¢ÃƒÆ’Ã‚Â¢ÃƒÂ¢Ã¢â€šÂ¬Ã…Â¡Ãƒâ€šÃ‚Â¬ÃƒÆ’Ã¢â‚¬Â¦Ãƒâ€šÃ‚Â¡ÃƒÆ’Ã†â€™Ãƒâ€ Ã¢â‚¬â„¢ÃƒÆ’Ã‚Â¢ÃƒÂ¢Ã¢â‚¬Å¡Ã‚Â¬Ãƒâ€¦Ã‚Â¡ÃƒÆ’Ã†â€™ÃƒÂ¢Ã¢â€šÂ¬Ã…Â¡ÃƒÆ’Ã¢â‚¬Å¡Ãƒâ€šÃ‚Â¡ÃƒÆ’Ã†â€™Ãƒâ€ Ã¢â‚¬â„¢ÃƒÆ’Ã¢â‚¬Â ÃƒÂ¢Ã¢â€šÂ¬Ã¢â€žÂ¢ÃƒÆ’Ã†â€™ÃƒÂ¢Ã¢â€šÂ¬Ã‚Â ÃƒÆ’Ã‚Â¢ÃƒÂ¢Ã¢â‚¬Å¡Ã‚Â¬ÃƒÂ¢Ã¢â‚¬Å¾Ã‚Â¢ÃƒÆ’Ã†â€™Ãƒâ€ Ã¢â‚¬â„¢ÃƒÆ’Ã‚Â¢ÃƒÂ¢Ã¢â‚¬Å¡Ã‚Â¬Ãƒâ€šÃ‚Â ÃƒÆ’Ã†â€™Ãƒâ€šÃ‚Â¢ÃƒÆ’Ã‚Â¢ÃƒÂ¢Ã¢â€šÂ¬Ã…Â¡Ãƒâ€šÃ‚Â¬ÃƒÆ’Ã‚Â¢ÃƒÂ¢Ã¢â€šÂ¬Ã…Â¾Ãƒâ€šÃ‚Â¢ÃƒÆ’Ã†â€™Ãƒâ€ Ã¢â‚¬â„¢ÃƒÆ’Ã¢â‚¬Â ÃƒÂ¢Ã¢â€šÂ¬Ã¢â€žÂ¢ÃƒÆ’Ã†â€™ÃƒÂ¢Ã¢â€šÂ¬Ã…Â¡ÃƒÆ’Ã¢â‚¬Å¡Ãƒâ€šÃ‚Â¢ÃƒÆ’Ã†â€™Ãƒâ€ Ã¢â‚¬â„¢ÃƒÆ’Ã¢â‚¬Å¡Ãƒâ€šÃ‚Â¢ÃƒÆ’Ã†â€™Ãƒâ€šÃ‚Â¢ÃƒÆ’Ã‚Â¢ÃƒÂ¢Ã¢â€šÂ¬Ã…Â¡Ãƒâ€šÃ‚Â¬ÃƒÆ’Ã¢â‚¬Â¦Ãƒâ€šÃ‚Â¡ÃƒÆ’Ã†â€™ÃƒÂ¢Ã¢â€šÂ¬Ã…Â¡ÃƒÆ’Ã¢â‚¬Å¡Ãƒâ€šÃ‚Â¬ÃƒÆ’Ã†â€™Ãƒâ€ Ã¢â‚¬â„¢ÃƒÆ’Ã‚Â¢ÃƒÂ¢Ã¢â‚¬Å¡Ã‚Â¬Ãƒâ€šÃ‚Â¦ÃƒÆ’Ã†â€™ÃƒÂ¢Ã¢â€šÂ¬Ã…Â¡ÃƒÆ’Ã¢â‚¬Å¡Ãƒâ€šÃ‚Â¡ÃƒÆ’Ã†â€™Ãƒâ€ Ã¢â‚¬â„¢ÃƒÆ’Ã¢â‚¬Â ÃƒÂ¢Ã¢â€šÂ¬Ã¢â€žÂ¢ÃƒÆ’Ã†â€™ÃƒÂ¢Ã¢â€šÂ¬Ã‚Â ÃƒÆ’Ã‚Â¢ÃƒÂ¢Ã¢â‚¬Å¡Ã‚Â¬ÃƒÂ¢Ã¢â‚¬Å¾Ã‚Â¢ÃƒÆ’Ã†â€™Ãƒâ€ Ã¢â‚¬â„¢ÃƒÆ’Ã¢â‚¬Å¡Ãƒâ€šÃ‚Â¢ÃƒÆ’Ã†â€™Ãƒâ€šÃ‚Â¢ÃƒÆ’Ã‚Â¢ÃƒÂ¢Ã¢â‚¬Å¡Ã‚Â¬Ãƒâ€¦Ã‚Â¡ÃƒÆ’Ã¢â‚¬Å¡Ãƒâ€šÃ‚Â¬ÃƒÆ’Ã†â€™ÃƒÂ¢Ã¢â€šÂ¬Ã‚Â¦ÃƒÆ’Ã¢â‚¬Å¡Ãƒâ€šÃ‚Â¡ÃƒÆ’Ã†â€™Ãƒâ€ Ã¢â‚¬â„¢ÃƒÆ’Ã¢â‚¬Â ÃƒÂ¢Ã¢â€šÂ¬Ã¢â€žÂ¢ÃƒÆ’Ã†â€™Ãƒâ€šÃ‚Â¢ÃƒÆ’Ã‚Â¢ÃƒÂ¢Ã¢â€šÂ¬Ã…Â¡Ãƒâ€šÃ‚Â¬ÃƒÆ’Ã¢â‚¬Â¦Ãƒâ€šÃ‚Â¡ÃƒÆ’Ã†â€™Ãƒâ€ Ã¢â‚¬â„¢ÃƒÆ’Ã‚Â¢ÃƒÂ¢Ã¢â‚¬Å¡Ã‚Â¬Ãƒâ€¦Ã‚Â¡ÃƒÆ’Ã†â€™ÃƒÂ¢Ã¢â€šÂ¬Ã…Â¡ÃƒÆ’Ã¢â‚¬Å¡Ãƒâ€šÃ‚Â¬ÃƒÆ’Ã†â€™Ãƒâ€ Ã¢â‚¬â„¢ÃƒÆ’Ã¢â‚¬Â ÃƒÂ¢Ã¢â€šÂ¬Ã¢â€žÂ¢ÃƒÆ’Ã†â€™ÃƒÂ¢Ã¢â€šÂ¬Ã‚Â ÃƒÆ’Ã‚Â¢ÃƒÂ¢Ã¢â‚¬Å¡Ã‚Â¬ÃƒÂ¢Ã¢â‚¬Å¾Ã‚Â¢ÃƒÆ’Ã†â€™Ãƒâ€ Ã¢â‚¬â„¢ÃƒÆ’Ã‚Â¢ÃƒÂ¢Ã¢â‚¬Å¡Ã‚Â¬Ãƒâ€šÃ‚Â ÃƒÆ’Ã†â€™Ãƒâ€šÃ‚Â¢ÃƒÆ’Ã‚Â¢ÃƒÂ¢Ã¢â€šÂ¬Ã…Â¡Ãƒâ€šÃ‚Â¬ÃƒÆ’Ã‚Â¢ÃƒÂ¢Ã¢â€šÂ¬Ã…Â¾Ãƒâ€šÃ‚Â¢ÃƒÆ’Ã†â€™Ãƒâ€ Ã¢â‚¬â„¢ÃƒÆ’Ã¢â‚¬Â ÃƒÂ¢Ã¢â€šÂ¬Ã¢â€žÂ¢ÃƒÆ’Ã†â€™Ãƒâ€šÃ‚Â¢ÃƒÆ’Ã‚Â¢ÃƒÂ¢Ã¢â€šÂ¬Ã…Â¡Ãƒâ€šÃ‚Â¬ÃƒÆ’Ã¢â‚¬Å¡Ãƒâ€šÃ‚Â ÃƒÆ’Ã†â€™Ãƒâ€ Ã¢â‚¬â„¢ÃƒÆ’Ã¢â‚¬Å¡Ãƒâ€šÃ‚Â¢ÃƒÆ’Ã†â€™Ãƒâ€šÃ‚Â¢ÃƒÆ’Ã‚Â¢ÃƒÂ¢Ã¢â‚¬Å¡Ã‚Â¬Ãƒâ€¦Ã‚Â¡ÃƒÆ’Ã¢â‚¬Å¡Ãƒâ€šÃ‚Â¬ÃƒÆ’Ã†â€™Ãƒâ€šÃ‚Â¢ÃƒÆ’Ã‚Â¢ÃƒÂ¢Ã¢â‚¬Å¡Ã‚Â¬Ãƒâ€¦Ã‚Â¾ÃƒÆ’Ã¢â‚¬Å¡Ãƒâ€šÃ‚Â¢ÃƒÆ’Ã†â€™Ãƒâ€ Ã¢â‚¬â„¢ÃƒÆ’Ã¢â‚¬Â ÃƒÂ¢Ã¢â€šÂ¬Ã¢â€žÂ¢ÃƒÆ’Ã†â€™ÃƒÂ¢Ã¢â€šÂ¬Ã‚Â ÃƒÆ’Ã‚Â¢ÃƒÂ¢Ã¢â‚¬Å¡Ã‚Â¬ÃƒÂ¢Ã¢â‚¬Å¾Ã‚Â¢ÃƒÆ’Ã†â€™Ãƒâ€ Ã¢â‚¬â„¢ÃƒÆ’Ã¢â‚¬Å¡Ãƒâ€šÃ‚Â¢ÃƒÆ’Ã†â€™Ãƒâ€šÃ‚Â¢ÃƒÆ’Ã‚Â¢ÃƒÂ¢Ã¢â‚¬Å¡Ã‚Â¬Ãƒâ€¦Ã‚Â¡ÃƒÆ’Ã¢â‚¬Å¡Ãƒâ€šÃ‚Â¬ÃƒÆ’Ã†â€™ÃƒÂ¢Ã¢â€šÂ¬Ã‚Â¦ÃƒÆ’Ã¢â‚¬Å¡Ãƒâ€šÃ‚Â¡ÃƒÆ’Ã†â€™Ãƒâ€ Ã¢â‚¬â„¢ÃƒÆ’Ã¢â‚¬Â ÃƒÂ¢Ã¢â€šÂ¬Ã¢â€žÂ¢ÃƒÆ’Ã†â€™Ãƒâ€šÃ‚Â¢ÃƒÆ’Ã‚Â¢ÃƒÂ¢Ã¢â€šÂ¬Ã…Â¡Ãƒâ€šÃ‚Â¬ÃƒÆ’Ã¢â‚¬Â¦Ãƒâ€šÃ‚Â¡ÃƒÆ’Ã†â€™Ãƒâ€ Ã¢â‚¬â„¢ÃƒÆ’Ã‚Â¢ÃƒÂ¢Ã¢â‚¬Å¡Ã‚Â¬Ãƒâ€¦Ã‚Â¡ÃƒÆ’Ã†â€™ÃƒÂ¢Ã¢â€šÂ¬Ã…Â¡ÃƒÆ’Ã¢â‚¬Å¡Ãƒâ€šÃ‚Â¢ÃƒÆ’Ã†â€™Ãƒâ€ Ã¢â‚¬â„¢ÃƒÆ’Ã¢â‚¬Â ÃƒÂ¢Ã¢â€šÂ¬Ã¢â€žÂ¢ÃƒÆ’Ã†â€™ÃƒÂ¢Ã¢â€šÂ¬Ã‚Â ÃƒÆ’Ã‚Â¢ÃƒÂ¢Ã¢â‚¬Å¡Ã‚Â¬ÃƒÂ¢Ã¢â‚¬Å¾Ã‚Â¢ÃƒÆ’Ã†â€™Ãƒâ€ Ã¢â‚¬â„¢ÃƒÆ’Ã‚Â¢ÃƒÂ¢Ã¢â‚¬Å¡Ã‚Â¬Ãƒâ€šÃ‚Â ÃƒÆ’Ã†â€™Ãƒâ€šÃ‚Â¢ÃƒÆ’Ã‚Â¢ÃƒÂ¢Ã¢â€šÂ¬Ã…Â¡Ãƒâ€šÃ‚Â¬ÃƒÆ’Ã‚Â¢ÃƒÂ¢Ã¢â€šÂ¬Ã…Â¾Ãƒâ€šÃ‚Â¢ÃƒÆ’Ã†â€™Ãƒâ€ Ã¢â‚¬â„¢ÃƒÆ’Ã¢â‚¬Â ÃƒÂ¢Ã¢â€šÂ¬Ã¢â€žÂ¢ÃƒÆ’Ã†â€™Ãƒâ€šÃ‚Â¢ÃƒÆ’Ã‚Â¢ÃƒÂ¢Ã¢â€šÂ¬Ã…Â¡Ãƒâ€šÃ‚Â¬ÃƒÆ’Ã¢â‚¬Â¦Ãƒâ€šÃ‚Â¡ÃƒÆ’Ã†â€™Ãƒâ€ Ã¢â‚¬â„¢ÃƒÆ’Ã‚Â¢ÃƒÂ¢Ã¢â‚¬Å¡Ã‚Â¬Ãƒâ€¦Ã‚Â¡ÃƒÆ’Ã†â€™ÃƒÂ¢Ã¢â€šÂ¬Ã…Â¡ÃƒÆ’Ã¢â‚¬Å¡Ãƒâ€šÃ‚Â¢ÃƒÆ’Ã†â€™Ãƒâ€ Ã¢â‚¬â„¢ÃƒÆ’Ã¢â‚¬Â ÃƒÂ¢Ã¢â€šÂ¬Ã¢â€žÂ¢ÃƒÆ’Ã†â€™ÃƒÂ¢Ã¢â€šÂ¬Ã‚Â ÃƒÆ’Ã‚Â¢ÃƒÂ¢Ã¢â‚¬Å¡Ã‚Â¬ÃƒÂ¢Ã¢â‚¬Å¾Ã‚Â¢ÃƒÆ’Ã†â€™Ãƒâ€ Ã¢â‚¬â„¢ÃƒÆ’Ã‚Â¢ÃƒÂ¢Ã¢â‚¬Å¡Ã‚Â¬Ãƒâ€¦Ã‚Â¡ÃƒÆ’Ã†â€™ÃƒÂ¢Ã¢â€šÂ¬Ã…Â¡ÃƒÆ’Ã¢â‚¬Å¡Ãƒâ€šÃ‚Â¢ÃƒÆ’Ã†â€™Ãƒâ€ Ã¢â‚¬â„¢ÃƒÆ’Ã¢â‚¬Â ÃƒÂ¢Ã¢â€šÂ¬Ã¢â€žÂ¢ÃƒÆ’Ã†â€™ÃƒÂ¢Ã¢â€šÂ¬Ã…Â¡ÃƒÆ’Ã¢â‚¬Å¡Ãƒâ€šÃ‚Â¢ÃƒÆ’Ã†â€™Ãƒâ€ Ã¢â‚¬â„¢ÃƒÆ’Ã¢â‚¬Å¡Ãƒâ€šÃ‚Â¢ÃƒÆ’Ã†â€™Ãƒâ€šÃ‚Â¢ÃƒÆ’Ã‚Â¢ÃƒÂ¢Ã¢â‚¬Å¡Ã‚Â¬Ãƒâ€¦Ã‚Â¡ÃƒÆ’Ã¢â‚¬Å¡Ãƒâ€šÃ‚Â¬ÃƒÆ’Ã†â€™ÃƒÂ¢Ã¢â€šÂ¬Ã‚Â¦ÃƒÆ’Ã¢â‚¬Å¡Ãƒâ€šÃ‚Â¡ÃƒÆ’Ã†â€™Ãƒâ€ Ã¢â‚¬â„¢ÃƒÆ’Ã‚Â¢ÃƒÂ¢Ã¢â‚¬Å¡Ã‚Â¬Ãƒâ€¦Ã‚Â¡ÃƒÆ’Ã†â€™ÃƒÂ¢Ã¢â€šÂ¬Ã…Â¡ÃƒÆ’Ã¢â‚¬Å¡Ãƒâ€šÃ‚Â¬ÃƒÆ’Ã†â€™Ãƒâ€ Ã¢â‚¬â„¢ÃƒÆ’Ã¢â‚¬Â ÃƒÂ¢Ã¢â€šÂ¬Ã¢â€žÂ¢ÃƒÆ’Ã†â€™Ãƒâ€šÃ‚Â¢ÃƒÆ’Ã‚Â¢ÃƒÂ¢Ã¢â€šÂ¬Ã…Â¡Ãƒâ€šÃ‚Â¬ÃƒÆ’Ã¢â‚¬Å¡Ãƒâ€šÃ‚Â¦ÃƒÆ’Ã†â€™Ãƒâ€ Ã¢â‚¬â„¢ÃƒÆ’Ã‚Â¢ÃƒÂ¢Ã¢â‚¬Å¡Ã‚Â¬Ãƒâ€¦Ã‚Â¡ÃƒÆ’Ã†â€™ÃƒÂ¢Ã¢â€šÂ¬Ã…Â¡ÃƒÆ’Ã¢â‚¬Å¡Ãƒâ€šÃ‚Â¡ÃƒÆ’Ã†â€™Ãƒâ€ Ã¢â‚¬â„¢ÃƒÆ’Ã¢â‚¬Â ÃƒÂ¢Ã¢â€šÂ¬Ã¢â€žÂ¢ÃƒÆ’Ã†â€™ÃƒÂ¢Ã¢â€šÂ¬Ã‚Â ÃƒÆ’Ã‚Â¢ÃƒÂ¢Ã¢â‚¬Å¡Ã‚Â¬ÃƒÂ¢Ã¢â‚¬Å¾Ã‚Â¢ÃƒÆ’Ã†â€™Ãƒâ€ Ã¢â‚¬â„¢ÃƒÆ’Ã¢â‚¬Å¡Ãƒâ€šÃ‚Â¢ÃƒÆ’Ã†â€™Ãƒâ€šÃ‚Â¢ÃƒÆ’Ã‚Â¢ÃƒÂ¢Ã¢â‚¬Å¡Ã‚Â¬Ãƒâ€¦Ã‚Â¡ÃƒÆ’Ã¢â‚¬Å¡Ãƒâ€šÃ‚Â¬ÃƒÆ’Ã†â€™ÃƒÂ¢Ã¢â€šÂ¬Ã‚Â¦ÃƒÆ’Ã¢â‚¬Å¡Ãƒâ€šÃ‚Â¡ÃƒÆ’Ã†â€™Ãƒâ€ Ã¢â‚¬â„¢ÃƒÆ’Ã¢â‚¬Â ÃƒÂ¢Ã¢â€šÂ¬Ã¢â€žÂ¢ÃƒÆ’Ã†â€™Ãƒâ€šÃ‚Â¢ÃƒÆ’Ã‚Â¢ÃƒÂ¢Ã¢â€šÂ¬Ã…Â¡Ãƒâ€šÃ‚Â¬ÃƒÆ’Ã¢â‚¬Â¦Ãƒâ€šÃ‚Â¡ÃƒÆ’Ã†â€™Ãƒâ€ Ã¢â‚¬â„¢ÃƒÆ’Ã‚Â¢ÃƒÂ¢Ã¢â‚¬Å¡Ã‚Â¬Ãƒâ€¦Ã‚Â¡ÃƒÆ’Ã†â€™ÃƒÂ¢Ã¢â€šÂ¬Ã…Â¡ÃƒÆ’Ã¢â‚¬Å¡Ãƒâ€šÃ‚Â¬ÃƒÆ’Ã†â€™Ãƒâ€ Ã¢â‚¬â„¢ÃƒÆ’Ã¢â‚¬Â ÃƒÂ¢Ã¢â€šÂ¬Ã¢â€žÂ¢ÃƒÆ’Ã†â€™ÃƒÂ¢Ã¢â€šÂ¬Ã‚Â ÃƒÆ’Ã‚Â¢ÃƒÂ¢Ã¢â‚¬Å¡Ã‚Â¬ÃƒÂ¢Ã¢â‚¬Å¾Ã‚Â¢ÃƒÆ’Ã†â€™Ãƒâ€ Ã¢â‚¬â„¢ÃƒÆ’Ã‚Â¢ÃƒÂ¢Ã¢â‚¬Å¡Ã‚Â¬Ãƒâ€šÃ‚Â ÃƒÆ’Ã†â€™Ãƒâ€šÃ‚Â¢ÃƒÆ’Ã‚Â¢ÃƒÂ¢Ã¢â€šÂ¬Ã…Â¡Ãƒâ€šÃ‚Â¬ÃƒÆ’Ã‚Â¢ÃƒÂ¢Ã¢â€šÂ¬Ã…Â¾Ãƒâ€šÃ‚Â¢ÃƒÆ’Ã†â€™Ãƒâ€ Ã¢â‚¬â„¢ÃƒÆ’Ã¢â‚¬Â ÃƒÂ¢Ã¢â€šÂ¬Ã¢â€žÂ¢ÃƒÆ’Ã†â€™ÃƒÂ¢Ã¢â€šÂ¬Ã…Â¡ÃƒÆ’Ã¢â‚¬Å¡Ãƒâ€šÃ‚Â¢ÃƒÆ’Ã†â€™Ãƒâ€ Ã¢â‚¬â„¢ÃƒÆ’Ã¢â‚¬Å¡Ãƒâ€šÃ‚Â¢ÃƒÆ’Ã†â€™Ãƒâ€šÃ‚Â¢ÃƒÆ’Ã‚Â¢ÃƒÂ¢Ã¢â€šÂ¬Ã…Â¡Ãƒâ€šÃ‚Â¬ÃƒÆ’Ã¢â‚¬Â¦Ãƒâ€šÃ‚Â¡ÃƒÆ’Ã†â€™ÃƒÂ¢Ã¢â€šÂ¬Ã…Â¡ÃƒÆ’Ã¢â‚¬Å¡Ãƒâ€šÃ‚Â¬ÃƒÆ’Ã†â€™Ãƒâ€ Ã¢â‚¬â„¢ÃƒÆ’Ã‚Â¢ÃƒÂ¢Ã¢â‚¬Å¡Ã‚Â¬Ãƒâ€¦Ã‚Â¡ÃƒÆ’Ã†â€™ÃƒÂ¢Ã¢â€šÂ¬Ã…Â¡ÃƒÆ’Ã¢â‚¬Å¡Ãƒâ€šÃ‚Â¦ÃƒÆ’Ã†â€™Ãƒâ€ Ã¢â‚¬â„¢ÃƒÆ’Ã¢â‚¬Â ÃƒÂ¢Ã¢â€šÂ¬Ã¢â€žÂ¢ÃƒÆ’Ã†â€™ÃƒÂ¢Ã¢â€šÂ¬Ã‚Â ÃƒÆ’Ã‚Â¢ÃƒÂ¢Ã¢â‚¬Å¡Ã‚Â¬ÃƒÂ¢Ã¢â‚¬Å¾Ã‚Â¢ÃƒÆ’Ã†â€™Ãƒâ€ Ã¢â‚¬â„¢ÃƒÆ’Ã‚Â¢ÃƒÂ¢Ã¢â‚¬Å¡Ã‚Â¬Ãƒâ€¦Ã‚Â¡ÃƒÆ’Ã†â€™ÃƒÂ¢Ã¢â€šÂ¬Ã…Â¡ÃƒÆ’Ã¢â‚¬Å¡Ãƒâ€šÃ‚Â¢ÃƒÆ’Ã†â€™Ãƒâ€ Ã¢â‚¬â„¢ÃƒÆ’Ã¢â‚¬Â ÃƒÂ¢Ã¢â€šÂ¬Ã¢â€žÂ¢ÃƒÆ’Ã†â€™ÃƒÂ¢Ã¢â€šÂ¬Ã…Â¡ÃƒÆ’Ã¢â‚¬Å¡Ãƒâ€šÃ‚Â¢ÃƒÆ’Ã†â€™Ãƒâ€ Ã¢â‚¬â„¢ÃƒÆ’Ã¢â‚¬Å¡Ãƒâ€šÃ‚Â¢ÃƒÆ’Ã†â€™Ãƒâ€šÃ‚Â¢ÃƒÆ’Ã‚Â¢ÃƒÂ¢Ã¢â‚¬Å¡Ã‚Â¬Ãƒâ€¦Ã‚Â¡ÃƒÆ’Ã¢â‚¬Å¡Ãƒâ€šÃ‚Â¬ÃƒÆ’Ã†â€™ÃƒÂ¢Ã¢â€šÂ¬Ã‚Â¦ÃƒÆ’Ã¢â‚¬Å¡Ãƒâ€šÃ‚Â¡ÃƒÆ’Ã†â€™Ãƒâ€ Ã¢â‚¬â„¢ÃƒÆ’Ã‚Â¢ÃƒÂ¢Ã¢â‚¬Å¡Ã‚Â¬Ãƒâ€¦Ã‚Â¡ÃƒÆ’Ã†â€™ÃƒÂ¢Ã¢â€šÂ¬Ã…Â¡ÃƒÆ’Ã¢â‚¬Å¡Ãƒâ€šÃ‚Â¬ÃƒÆ’Ã†â€™Ãƒâ€ Ã¢â‚¬â„¢ÃƒÆ’Ã¢â‚¬Â ÃƒÂ¢Ã¢â€šÂ¬Ã¢â€žÂ¢ÃƒÆ’Ã†â€™Ãƒâ€šÃ‚Â¢ÃƒÆ’Ã‚Â¢ÃƒÂ¢Ã¢â€šÂ¬Ã…Â¡Ãƒâ€šÃ‚Â¬ÃƒÆ’Ã¢â‚¬Å¡Ãƒâ€šÃ‚Â¦ÃƒÆ’Ã†â€™Ãƒâ€ Ã¢â‚¬â„¢ÃƒÆ’Ã¢â‚¬Å¡Ãƒâ€šÃ‚Â¢ÃƒÆ’Ã†â€™Ãƒâ€šÃ‚Â¢ÃƒÆ’Ã‚Â¢ÃƒÂ¢Ã¢â‚¬Å¡Ã‚Â¬Ãƒâ€¦Ã‚Â¡ÃƒÆ’Ã¢â‚¬Å¡Ãƒâ€šÃ‚Â¬ÃƒÆ’Ã†â€™ÃƒÂ¢Ã¢â€šÂ¬Ã‚Â¦ÃƒÆ’Ã‚Â¢ÃƒÂ¢Ã¢â‚¬Å¡Ã‚Â¬Ãƒâ€¦Ã¢â‚¬Å“Wk4), both systems recovered strongly, with Monoculture showing a slightly higher growth rate (3.227%/day) than IMTA (2.958%/day).</w:t>
+      </w:r>
+    </w:p>
+    <w:p>
+      <w:pPr>
+        <w:spacing w:line="360" w:lineRule="auto"/>
+        <w:rPr>
+          <w:rFonts w:ascii="Times New Roman" w:hAnsi="Times New Roman" w:cs="Times New Roman"/>
+        </w:rPr>
+      </w:pPr>
+      <w:r>
+        <w:rPr>
+          <w:rFonts w:ascii="Times New Roman" w:hAnsi="Times New Roman" w:cs="Times New Roman"/>
+        </w:rPr>
+        <w:t xml:space="preserve">A clear difference in stability is observed during the Wk4ÃƒÆ’Ã†â€™Ãƒâ€ Ã¢â‚¬â„¢ÃƒÆ’Ã¢â‚¬Â ÃƒÂ¢Ã¢â€šÂ¬Ã¢â€žÂ¢ÃƒÆ’Ã†â€™ÃƒÂ¢Ã¢â€šÂ¬Ã‚Â ÃƒÆ’Ã‚Â¢ÃƒÂ¢Ã¢â‚¬Å¡Ã‚Â¬ÃƒÂ¢Ã¢â‚¬Å¾Ã‚Â¢ÃƒÆ’Ã†â€™Ãƒâ€ Ã¢â‚¬â„¢ÃƒÆ’Ã‚Â¢ÃƒÂ¢Ã¢â‚¬Å¡Ã‚Â¬Ãƒâ€šÃ‚Â ÃƒÆ’Ã†â€™Ãƒâ€šÃ‚Â¢ÃƒÆ’Ã‚Â¢ÃƒÂ¢Ã¢â€šÂ¬Ã…Â¡Ãƒâ€šÃ‚Â¬ÃƒÆ’Ã‚Â¢ÃƒÂ¢Ã¢â€šÂ¬Ã…Â¾Ãƒâ€šÃ‚Â¢ÃƒÆ’Ã†â€™Ãƒâ€ Ã¢â‚¬â„¢ÃƒÆ’Ã¢â‚¬Â ÃƒÂ¢Ã¢â€šÂ¬Ã¢â€žÂ¢ÃƒÆ’Ã†â€™Ãƒâ€šÃ‚Â¢ÃƒÆ’Ã‚Â¢ÃƒÂ¢Ã¢â€šÂ¬Ã…Â¡Ãƒâ€šÃ‚Â¬ÃƒÆ’Ã¢â‚¬Å¡Ãƒâ€šÃ‚Â ÃƒÆ’Ã†â€™Ãƒâ€ Ã¢â‚¬â„¢ÃƒÆ’Ã¢â‚¬Å¡Ãƒâ€šÃ‚Â¢ÃƒÆ’Ã†â€™Ãƒâ€šÃ‚Â¢ÃƒÆ’Ã‚Â¢ÃƒÂ¢Ã¢â‚¬Å¡Ã‚Â¬Ãƒâ€¦Ã‚Â¡ÃƒÆ’Ã¢â‚¬Å¡Ãƒâ€šÃ‚Â¬ÃƒÆ’Ã†â€™Ãƒâ€šÃ‚Â¢ÃƒÆ’Ã‚Â¢ÃƒÂ¢Ã¢â‚¬Å¡Ã‚Â¬Ãƒâ€¦Ã‚Â¾ÃƒÆ’Ã¢â‚¬Å¡Ãƒâ€šÃ‚Â¢ÃƒÆ’Ã†â€™Ãƒâ€ Ã¢â‚¬â„¢ÃƒÆ’Ã¢â‚¬Â ÃƒÂ¢Ã¢â€šÂ¬Ã¢â€žÂ¢ÃƒÆ’Ã†â€™ÃƒÂ¢Ã¢â€šÂ¬Ã‚Â ÃƒÆ’Ã‚Â¢ÃƒÂ¢Ã¢â‚¬Å¡Ã‚Â¬ÃƒÂ¢Ã¢â‚¬Å¾Ã‚Â¢ÃƒÆ’Ã†â€™Ãƒâ€ Ã¢â‚¬â„¢ÃƒÆ’Ã¢â‚¬Å¡Ãƒâ€šÃ‚Â¢ÃƒÆ’Ã†â€™Ãƒâ€šÃ‚Â¢ÃƒÆ’Ã‚Â¢ÃƒÂ¢Ã¢â‚¬Å¡Ã‚Â¬Ãƒâ€¦Ã‚Â¡ÃƒÆ’Ã¢â‚¬Å¡Ãƒâ€šÃ‚Â¬ÃƒÆ’Ã†â€™ÃƒÂ¢Ã¢â€šÂ¬Ã…Â¡ÃƒÆ’Ã¢â‚¬Å¡Ãƒâ€šÃ‚Â ÃƒÆ’Ã†â€™Ãƒâ€ Ã¢â‚¬â„¢ÃƒÆ’Ã¢â‚¬Â ÃƒÂ¢Ã¢â€šÂ¬Ã¢â€žÂ¢ÃƒÆ’Ã†â€™ÃƒÂ¢Ã¢â€šÂ¬Ã…Â¡ÃƒÆ’Ã¢â‚¬Å¡Ãƒâ€šÃ‚Â¢ÃƒÆ’Ã†â€™Ãƒâ€ Ã¢â‚¬â„¢ÃƒÆ’Ã¢â‚¬Å¡Ãƒâ€šÃ‚Â¢ÃƒÆ’Ã†â€™Ãƒâ€šÃ‚Â¢ÃƒÆ’Ã‚Â¢ÃƒÂ¢Ã¢â€šÂ¬Ã…Â¡Ãƒâ€šÃ‚Â¬ÃƒÆ’Ã¢â‚¬Â¦Ãƒâ€šÃ‚Â¡ÃƒÆ’Ã†â€™ÃƒÂ¢Ã¢â€šÂ¬Ã…Â¡ÃƒÆ’Ã¢â‚¬Å¡Ãƒâ€šÃ‚Â¬ÃƒÆ’Ã†â€™Ãƒâ€ Ã¢â‚¬â„¢ÃƒÆ’Ã¢â‚¬Å¡Ãƒâ€šÃ‚Â¢ÃƒÆ’Ã†â€™Ãƒâ€šÃ‚Â¢ÃƒÆ’Ã‚Â¢ÃƒÂ¢Ã¢â€šÂ¬Ã…Â¡Ãƒâ€šÃ‚Â¬ÃƒÆ’Ã¢â‚¬Â¦Ãƒâ€šÃ‚Â¾ÃƒÆ’Ã†â€™ÃƒÂ¢Ã¢â€šÂ¬Ã…Â¡ÃƒÆ’Ã¢â‚¬Å¡Ãƒâ€šÃ‚Â¢ÃƒÆ’Ã†â€™Ãƒâ€ Ã¢â‚¬â„¢ÃƒÆ’Ã¢â‚¬Â ÃƒÂ¢Ã¢â€šÂ¬Ã¢â€žÂ¢ÃƒÆ’Ã†â€™ÃƒÂ¢Ã¢â€šÂ¬Ã‚Â ÃƒÆ’Ã‚Â¢ÃƒÂ¢Ã¢â‚¬Å¡Ã‚Â¬ÃƒÂ¢Ã¢â‚¬Å¾Ã‚Â¢ÃƒÆ’Ã†â€™Ãƒâ€ Ã¢â‚¬â„¢ÃƒÆ’Ã‚Â¢ÃƒÂ¢Ã¢â‚¬Å¡Ã‚Â¬Ãƒâ€šÃ‚Â ÃƒÆ’Ã†â€™Ãƒâ€šÃ‚Â¢ÃƒÆ’Ã‚Â¢ÃƒÂ¢Ã¢â€šÂ¬Ã…Â¡Ãƒâ€šÃ‚Â¬ÃƒÆ’Ã‚Â¢ÃƒÂ¢Ã¢â€šÂ¬Ã…Â¾Ãƒâ€šÃ‚Â¢ÃƒÆ’Ã†â€™Ãƒâ€ Ã¢â‚¬â„¢ÃƒÆ’Ã¢â‚¬Â ÃƒÂ¢Ã¢â€šÂ¬Ã¢â€žÂ¢ÃƒÆ’Ã†â€™ÃƒÂ¢Ã¢â€šÂ¬Ã…Â¡ÃƒÆ’Ã¢â‚¬Å¡Ãƒâ€šÃ‚Â¢ÃƒÆ’Ã†â€™Ãƒâ€ Ã¢â‚¬â„¢ÃƒÆ’Ã¢â‚¬Å¡Ãƒâ€šÃ‚Â¢ÃƒÆ’Ã†â€™Ãƒâ€šÃ‚Â¢ÃƒÆ’Ã‚Â¢ÃƒÂ¢Ã¢â€šÂ¬Ã…Â¡Ãƒâ€šÃ‚Â¬ÃƒÆ’Ã¢â‚¬Â¦Ãƒâ€šÃ‚Â¡ÃƒÆ’Ã†â€™ÃƒÂ¢Ã¢â€šÂ¬Ã…Â¡ÃƒÆ’Ã¢â‚¬Å¡Ãƒâ€šÃ‚Â¬ÃƒÆ’Ã†â€™Ãƒâ€ Ã¢â‚¬â„¢ÃƒÆ’Ã‚Â¢ÃƒÂ¢Ã¢â‚¬Å¡Ã‚Â¬Ãƒâ€šÃ‚Â¦ÃƒÆ’Ã†â€™ÃƒÂ¢Ã¢â€šÂ¬Ã…Â¡ÃƒÆ’Ã¢â‚¬Å¡Ãƒâ€šÃ‚Â¡ÃƒÆ’Ã†â€™Ãƒâ€ Ã¢â‚¬â„¢ÃƒÆ’Ã¢â‚¬Â ÃƒÂ¢Ã¢â€šÂ¬Ã¢â€žÂ¢ÃƒÆ’Ã†â€™ÃƒÂ¢Ã¢â€šÂ¬Ã‚Â ÃƒÆ’Ã‚Â¢ÃƒÂ¢Ã¢â‚¬Å¡Ã‚Â¬ÃƒÂ¢Ã¢â‚¬Å¾Ã‚Â¢ÃƒÆ’Ã†â€™Ãƒâ€ Ã¢â‚¬â„¢ÃƒÆ’Ã¢â‚¬Å¡Ãƒâ€šÃ‚Â¢ÃƒÆ’Ã†â€™Ãƒâ€šÃ‚Â¢ÃƒÆ’Ã‚Â¢ÃƒÂ¢Ã¢â‚¬Å¡Ã‚Â¬Ãƒâ€¦Ã‚Â¡ÃƒÆ’Ã¢â‚¬Å¡Ãƒâ€šÃ‚Â¬ÃƒÆ’Ã†â€™ÃƒÂ¢Ã¢â€šÂ¬Ã‚Â¦ÃƒÆ’Ã¢â‚¬Å¡Ãƒâ€šÃ‚Â¡ÃƒÆ’Ã†â€™Ãƒâ€ Ã¢â‚¬â„¢ÃƒÆ’Ã¢â‚¬Â ÃƒÂ¢Ã¢â€šÂ¬Ã¢â€žÂ¢ÃƒÆ’Ã†â€™Ãƒâ€šÃ‚Â¢ÃƒÆ’Ã‚Â¢ÃƒÂ¢Ã¢â€šÂ¬Ã…Â¡Ãƒâ€šÃ‚Â¬ÃƒÆ’Ã¢â‚¬Â¦Ãƒâ€šÃ‚Â¡ÃƒÆ’Ã†â€™Ãƒâ€ Ã¢â‚¬â„¢ÃƒÆ’Ã‚Â¢ÃƒÂ¢Ã¢â‚¬Å¡Ã‚Â¬Ãƒâ€¦Ã‚Â¡ÃƒÆ’Ã†â€™ÃƒÂ¢Ã¢â€šÂ¬Ã…Â¡ÃƒÆ’Ã¢â‚¬Å¡Ãƒâ€šÃ‚Â¢ÃƒÆ’Ã†â€™Ãƒâ€ Ã¢â‚¬â„¢ÃƒÆ’Ã¢â‚¬Â ÃƒÂ¢Ã¢â€šÂ¬Ã¢â€žÂ¢ÃƒÆ’Ã†â€™ÃƒÂ¢Ã¢â€šÂ¬Ã‚Â ÃƒÆ’Ã‚Â¢ÃƒÂ¢Ã¢â‚¬Å¡Ã‚Â¬ÃƒÂ¢Ã¢â‚¬Å¾Ã‚Â¢ÃƒÆ’Ã†â€™Ãƒâ€ Ã¢â‚¬â„¢ÃƒÆ’Ã‚Â¢ÃƒÂ¢Ã¢â‚¬Å¡Ã‚Â¬Ãƒâ€šÃ‚Â ÃƒÆ’Ã†â€™Ãƒâ€šÃ‚Â¢ÃƒÆ’Ã‚Â¢ÃƒÂ¢Ã¢â€šÂ¬Ã…Â¡Ãƒâ€šÃ‚Â¬ÃƒÆ’Ã‚Â¢ÃƒÂ¢Ã¢â€šÂ¬Ã…Â¾Ãƒâ€šÃ‚Â¢ÃƒÆ’Ã†â€™Ãƒâ€ Ã¢â‚¬â„¢ÃƒÆ’Ã¢â‚¬Â ÃƒÂ¢Ã¢â€šÂ¬Ã¢â€žÂ¢ÃƒÆ’Ã†â€™Ãƒâ€šÃ‚Â¢ÃƒÆ’Ã‚Â¢ÃƒÂ¢Ã¢â€šÂ¬Ã…Â¡Ãƒâ€šÃ‚Â¬ÃƒÆ’Ã¢â‚¬Å¡Ãƒâ€šÃ‚Â ÃƒÆ’Ã†â€™Ãƒâ€ Ã¢â‚¬â„¢ÃƒÆ’Ã¢â‚¬Å¡Ãƒâ€šÃ‚Â¢ÃƒÆ’Ã†â€™Ãƒâ€šÃ‚Â¢ÃƒÆ’Ã‚Â¢ÃƒÂ¢Ã¢â‚¬Å¡Ã‚Â¬Ãƒâ€¦Ã‚Â¡ÃƒÆ’Ã¢â‚¬Å¡Ãƒâ€šÃ‚Â¬ÃƒÆ’Ã†â€™Ãƒâ€šÃ‚Â¢ÃƒÆ’Ã‚Â¢ÃƒÂ¢Ã¢â‚¬Å¡Ã‚Â¬Ãƒâ€¦Ã‚Â¾ÃƒÆ’Ã¢â‚¬Å¡Ãƒâ€šÃ‚Â¢ÃƒÆ’Ã†â€™Ãƒâ€ Ã¢â‚¬â„¢ÃƒÆ’Ã¢â‚¬Â ÃƒÂ¢Ã¢â€šÂ¬Ã¢â€žÂ¢ÃƒÆ’Ã†â€™ÃƒÂ¢Ã¢â€šÂ¬Ã‚Â ÃƒÆ’Ã‚Â¢ÃƒÂ¢Ã¢â‚¬Å¡Ã‚Â¬ÃƒÂ¢Ã¢â‚¬Å¾Ã‚Â¢ÃƒÆ’Ã†â€™Ãƒâ€ Ã¢â‚¬â„¢ÃƒÆ’Ã¢â‚¬Å¡Ãƒâ€šÃ‚Â¢ÃƒÆ’Ã†â€™Ãƒâ€šÃ‚Â¢ÃƒÆ’Ã‚Â¢ÃƒÂ¢Ã¢â‚¬Å¡Ã‚Â¬Ãƒâ€¦Ã‚Â¡ÃƒÆ’Ã¢â‚¬Å¡Ãƒâ€šÃ‚Â¬ÃƒÆ’Ã†â€™ÃƒÂ¢Ã¢â€šÂ¬Ã‚Â¦ÃƒÆ’Ã¢â‚¬Å¡Ãƒâ€šÃ‚Â¡ÃƒÆ’Ã†â€™Ãƒâ€ Ã¢â‚¬â„¢ÃƒÆ’Ã¢â‚¬Â ÃƒÂ¢Ã¢â€šÂ¬Ã¢â€žÂ¢ÃƒÆ’Ã†â€™Ãƒâ€šÃ‚Â¢ÃƒÆ’Ã‚Â¢ÃƒÂ¢Ã¢â€šÂ¬Ã…Â¡Ãƒâ€šÃ‚Â¬ÃƒÆ’Ã¢â‚¬Â¦Ãƒâ€šÃ‚Â¡ÃƒÆ’Ã†â€™Ãƒâ€ Ã¢â‚¬â„¢ÃƒÆ’Ã‚Â¢ÃƒÂ¢Ã¢â‚¬Å¡Ã‚Â¬Ãƒâ€¦Ã‚Â¡ÃƒÆ’Ã†â€™ÃƒÂ¢Ã¢â€šÂ¬Ã…Â¡ÃƒÆ’Ã¢â‚¬Å¡Ãƒâ€šÃ‚Â¢ÃƒÆ’Ã†â€™Ãƒâ€ Ã¢â‚¬â„¢ÃƒÆ’Ã¢â‚¬Â ÃƒÂ¢Ã¢â€šÂ¬Ã¢â€žÂ¢ÃƒÆ’Ã†â€™ÃƒÂ¢Ã¢â€šÂ¬Ã‚Â ÃƒÆ’Ã‚Â¢ÃƒÂ¢Ã¢â‚¬Å¡Ã‚Â¬ÃƒÂ¢Ã¢â‚¬Å¾Ã‚Â¢ÃƒÆ’Ã†â€™Ãƒâ€ Ã¢â‚¬â„¢ÃƒÆ’Ã‚Â¢ÃƒÂ¢Ã¢â‚¬Å¡Ã‚Â¬Ãƒâ€šÃ‚Â ÃƒÆ’Ã†â€™Ãƒâ€šÃ‚Â¢ÃƒÆ’Ã‚Â¢ÃƒÂ¢Ã¢â€šÂ¬Ã…Â¡Ãƒâ€šÃ‚Â¬ÃƒÆ’Ã‚Â¢ÃƒÂ¢Ã¢â€šÂ¬Ã…Â¾Ãƒâ€šÃ‚Â¢ÃƒÆ’Ã†â€™Ãƒâ€ Ã¢â‚¬â„¢ÃƒÆ’Ã¢â‚¬Â ÃƒÂ¢Ã¢â€šÂ¬Ã¢â€žÂ¢ÃƒÆ’Ã†â€™Ãƒâ€šÃ‚Â¢ÃƒÆ’Ã‚Â¢ÃƒÂ¢Ã¢â€šÂ¬Ã…Â¡Ãƒâ€šÃ‚Â¬ÃƒÆ’Ã¢â‚¬Â¦Ãƒâ€šÃ‚Â¡ÃƒÆ’Ã†â€™Ãƒâ€ Ã¢â‚¬â„¢ÃƒÆ’Ã‚Â¢ÃƒÂ¢Ã¢â‚¬Å¡Ã‚Â¬Ãƒâ€¦Ã‚Â¡ÃƒÆ’Ã†â€™ÃƒÂ¢Ã¢â€šÂ¬Ã…Â¡ÃƒÆ’Ã¢â‚¬Å¡Ãƒâ€šÃ‚Â¢ÃƒÆ’Ã†â€™Ãƒâ€ Ã¢â‚¬â„¢ÃƒÆ’Ã¢â‚¬Â ÃƒÂ¢Ã¢â€šÂ¬Ã¢â€žÂ¢ÃƒÆ’Ã†â€™ÃƒÂ¢Ã¢â€šÂ¬Ã‚Â ÃƒÆ’Ã‚Â¢ÃƒÂ¢Ã¢â‚¬Å¡Ã‚Â¬ÃƒÂ¢Ã¢â‚¬Å¾Ã‚Â¢ÃƒÆ’Ã†â€™Ãƒâ€ Ã¢â‚¬â„¢ÃƒÆ’Ã‚Â¢ÃƒÂ¢Ã¢â‚¬Å¡Ã‚Â¬Ãƒâ€¦Ã‚Â¡ÃƒÆ’Ã†â€™ÃƒÂ¢Ã¢â€šÂ¬Ã…Â¡ÃƒÆ’Ã¢â‚¬Å¡Ãƒâ€šÃ‚Â¢ÃƒÆ’Ã†â€™Ãƒâ€ Ã¢â‚¬â„¢ÃƒÆ’Ã¢â‚¬Â ÃƒÂ¢Ã¢â€šÂ¬Ã¢â€žÂ¢ÃƒÆ’Ã†â€™ÃƒÂ¢Ã¢â€šÂ¬Ã…Â¡ÃƒÆ’Ã¢â‚¬Å¡Ãƒâ€šÃ‚Â¢ÃƒÆ’Ã†â€™Ãƒâ€ Ã¢â‚¬â„¢ÃƒÆ’Ã¢â‚¬Å¡Ãƒâ€šÃ‚Â¢ÃƒÆ’Ã†â€™Ãƒâ€šÃ‚Â¢ÃƒÆ’Ã‚Â¢ÃƒÂ¢Ã¢â€šÂ¬Ã…Â¡Ãƒâ€šÃ‚Â¬ÃƒÆ’Ã¢â‚¬Â¦Ãƒâ€šÃ‚Â¡ÃƒÆ’Ã†â€™ÃƒÂ¢Ã¢â€šÂ¬Ã…Â¡ÃƒÆ’Ã¢â‚¬Å¡Ãƒâ€šÃ‚Â¬ÃƒÆ’Ã†â€™Ãƒâ€ Ã¢â‚¬â„¢ÃƒÆ’Ã‚Â¢ÃƒÂ¢Ã¢â‚¬Å¡Ã‚Â¬Ãƒâ€šÃ‚Â¦ÃƒÆ’Ã†â€™ÃƒÂ¢Ã¢â€šÂ¬Ã…Â¡ÃƒÆ’Ã¢â‚¬Å¡Ãƒâ€šÃ‚Â¡ÃƒÆ’Ã†â€™Ãƒâ€ Ã¢â‚¬â„¢ÃƒÆ’Ã¢â‚¬Â ÃƒÂ¢Ã¢â€šÂ¬Ã¢â€žÂ¢ÃƒÆ’Ã†â€™Ãƒâ€šÃ‚Â¢ÃƒÆ’Ã‚Â¢ÃƒÂ¢Ã¢â€šÂ¬Ã…Â¡Ãƒâ€šÃ‚Â¬ÃƒÆ’Ã¢â‚¬Â¦Ãƒâ€šÃ‚Â¡ÃƒÆ’Ã†â€™Ãƒâ€ Ã¢â‚¬â„¢ÃƒÆ’Ã‚Â¢ÃƒÂ¢Ã¢â‚¬Å¡Ã‚Â¬Ãƒâ€¦Ã‚Â¡ÃƒÆ’Ã†â€™ÃƒÂ¢Ã¢â€šÂ¬Ã…Â¡ÃƒÆ’Ã¢â‚¬Å¡Ãƒâ€šÃ‚Â¬ÃƒÆ’Ã†â€™Ãƒâ€ Ã¢â‚¬â„¢ÃƒÆ’Ã¢â‚¬Â ÃƒÂ¢Ã¢â€šÂ¬Ã¢â€žÂ¢ÃƒÆ’Ã†â€™ÃƒÂ¢Ã¢â€šÂ¬Ã‚Â ÃƒÆ’Ã‚Â¢ÃƒÂ¢Ã¢â‚¬Å¡Ã‚Â¬ÃƒÂ¢Ã¢â‚¬Å¾Ã‚Â¢ÃƒÆ’Ã†â€™Ãƒâ€ Ã¢â‚¬â„¢ÃƒÆ’Ã¢â‚¬Å¡Ãƒâ€šÃ‚Â¢ÃƒÆ’Ã†â€™Ãƒâ€šÃ‚Â¢ÃƒÆ’Ã‚Â¢ÃƒÂ¢Ã¢â‚¬Å¡Ã‚Â¬Ãƒâ€¦Ã‚Â¡ÃƒÆ’Ã¢â‚¬Å¡Ãƒâ€šÃ‚Â¬ÃƒÆ’Ã†â€™ÃƒÂ¢Ã¢â€šÂ¬Ã…Â¡ÃƒÆ’Ã¢â‚¬Å¡Ãƒâ€šÃ‚Â¦ÃƒÆ’Ã†â€™Ãƒâ€ Ã¢â‚¬â„¢ÃƒÆ’Ã¢â‚¬Â ÃƒÂ¢Ã¢â€šÂ¬Ã¢â€žÂ¢ÃƒÆ’Ã†â€™Ãƒâ€šÃ‚Â¢ÃƒÆ’Ã‚Â¢ÃƒÂ¢Ã¢â€šÂ¬Ã…Â¡Ãƒâ€šÃ‚Â¬ÃƒÆ’Ã¢â‚¬Â¦Ãƒâ€šÃ‚Â¡ÃƒÆ’Ã†â€™Ãƒâ€ Ã¢â‚¬â„¢ÃƒÆ’Ã‚Â¢ÃƒÂ¢Ã¢â‚¬Å¡Ã‚Â¬Ãƒâ€¦Ã‚Â¡ÃƒÆ’Ã†â€™ÃƒÂ¢Ã¢â€šÂ¬Ã…Â¡ÃƒÆ’Ã¢â‚¬Å¡Ãƒâ€šÃ‚Â¡ÃƒÆ’Ã†â€™Ãƒâ€ Ã¢â‚¬â„¢ÃƒÆ’Ã¢â‚¬Â ÃƒÂ¢Ã¢â€šÂ¬Ã¢â€žÂ¢ÃƒÆ’Ã†â€™ÃƒÂ¢Ã¢â€šÂ¬Ã‚Â ÃƒÆ’Ã‚Â¢ÃƒÂ¢Ã¢â‚¬Å¡Ã‚Â¬ÃƒÂ¢Ã¢â‚¬Å¾Ã‚Â¢ÃƒÆ’Ã†â€™Ãƒâ€ Ã¢â‚¬â„¢ÃƒÆ’Ã‚Â¢ÃƒÂ¢Ã¢â‚¬Å¡Ã‚Â¬Ãƒâ€šÃ‚Â ÃƒÆ’Ã†â€™Ãƒâ€šÃ‚Â¢ÃƒÆ’Ã‚Â¢ÃƒÂ¢Ã¢â€šÂ¬Ã…Â¡Ãƒâ€šÃ‚Â¬ÃƒÆ’Ã‚Â¢ÃƒÂ¢Ã¢â€šÂ¬Ã…Â¾Ãƒâ€šÃ‚Â¢ÃƒÆ’Ã†â€™Ãƒâ€ Ã¢â‚¬â„¢ÃƒÆ’Ã¢â‚¬Â ÃƒÂ¢Ã¢â€šÂ¬Ã¢â€žÂ¢ÃƒÆ’Ã†â€™ÃƒÂ¢Ã¢â€šÂ¬Ã…Â¡ÃƒÆ’Ã¢â‚¬Å¡Ãƒâ€šÃ‚Â¢ÃƒÆ’Ã†â€™Ãƒâ€ Ã¢â‚¬â„¢ÃƒÆ’Ã¢â‚¬Å¡Ãƒâ€šÃ‚Â¢ÃƒÆ’Ã†â€™Ãƒâ€šÃ‚Â¢ÃƒÆ’Ã‚Â¢ÃƒÂ¢Ã¢â€šÂ¬Ã…Â¡Ãƒâ€šÃ‚Â¬ÃƒÆ’Ã¢â‚¬Â¦Ãƒâ€šÃ‚Â¡ÃƒÆ’Ã†â€™ÃƒÂ¢Ã¢â€šÂ¬Ã…Â¡ÃƒÆ’Ã¢â‚¬Å¡Ãƒâ€šÃ‚Â¬ÃƒÆ’Ã†â€™Ãƒâ€ Ã¢â‚¬â„¢ÃƒÆ’Ã‚Â¢ÃƒÂ¢Ã¢â‚¬Å¡Ã‚Â¬Ãƒâ€šÃ‚Â¦ÃƒÆ’Ã†â€™ÃƒÂ¢Ã¢â€šÂ¬Ã…Â¡ÃƒÆ’Ã¢â‚¬Å¡Ãƒâ€šÃ‚Â¡ÃƒÆ’Ã†â€™Ãƒâ€ Ã¢â‚¬â„¢ÃƒÆ’Ã¢â‚¬Â ÃƒÂ¢Ã¢â€šÂ¬Ã¢â€žÂ¢ÃƒÆ’Ã†â€™ÃƒÂ¢Ã¢â€šÂ¬Ã‚Â ÃƒÆ’Ã‚Â¢ÃƒÂ¢Ã¢â‚¬Å¡Ã‚Â¬ÃƒÂ¢Ã¢â‚¬Å¾Ã‚Â¢ÃƒÆ’Ã†â€™Ãƒâ€ Ã¢â‚¬â„¢ÃƒÆ’Ã¢â‚¬Å¡Ãƒâ€šÃ‚Â¢ÃƒÆ’Ã†â€™Ãƒâ€šÃ‚Â¢ÃƒÆ’Ã‚Â¢ÃƒÂ¢Ã¢â‚¬Å¡Ã‚Â¬Ãƒâ€¦Ã‚Â¡ÃƒÆ’Ã¢â‚¬Å¡Ãƒâ€šÃ‚Â¬ÃƒÆ’Ã†â€™ÃƒÂ¢Ã¢â€šÂ¬Ã‚Â¦ÃƒÆ’Ã¢â‚¬Å¡Ãƒâ€šÃ‚Â¡ÃƒÆ’Ã†â€™Ãƒâ€ Ã¢â‚¬â„¢ÃƒÆ’Ã¢â‚¬Â ÃƒÂ¢Ã¢â€šÂ¬Ã¢â€žÂ¢ÃƒÆ’Ã†â€™Ãƒâ€šÃ‚Â¢ÃƒÆ’Ã‚Â¢ÃƒÂ¢Ã¢â€šÂ¬Ã…Â¡Ãƒâ€šÃ‚Â¬ÃƒÆ’Ã¢â‚¬Â¦Ãƒâ€šÃ‚Â¡ÃƒÆ’Ã†â€™Ãƒâ€ Ã¢â‚¬â„¢ÃƒÆ’Ã‚Â¢ÃƒÂ¢Ã¢â‚¬Å¡Ã‚Â¬Ãƒâ€¦Ã‚Â¡ÃƒÆ’Ã†â€™ÃƒÂ¢Ã¢â€šÂ¬Ã…Â¡ÃƒÆ’Ã¢â‚¬Å¡Ãƒâ€šÃ‚Â¬ÃƒÆ’Ã†â€™Ãƒâ€ Ã¢â‚¬â„¢ÃƒÆ’Ã¢â‚¬Â ÃƒÂ¢Ã¢â€šÂ¬Ã¢â€žÂ¢ÃƒÆ’Ã†â€™ÃƒÂ¢Ã¢â€šÂ¬Ã‚Â ÃƒÆ’Ã‚Â¢ÃƒÂ¢Ã¢â‚¬Å¡Ã‚Â¬ÃƒÂ¢Ã¢â‚¬Å¾Ã‚Â¢ÃƒÆ’Ã†â€™Ãƒâ€ Ã¢â‚¬â„¢ÃƒÆ’Ã‚Â¢ÃƒÂ¢Ã¢â‚¬Å¡Ã‚Â¬Ãƒâ€šÃ‚Â ÃƒÆ’Ã†â€™Ãƒâ€šÃ‚Â¢ÃƒÆ’Ã‚Â¢ÃƒÂ¢Ã¢â€šÂ¬Ã…Â¡Ãƒâ€šÃ‚Â¬ÃƒÆ’Ã‚Â¢ÃƒÂ¢Ã¢â€šÂ¬Ã…Â¾Ãƒâ€šÃ‚Â¢ÃƒÆ’Ã†â€™Ãƒâ€ Ã¢â‚¬â„¢ÃƒÆ’Ã¢â‚¬Â ÃƒÂ¢Ã¢â€šÂ¬Ã¢â€žÂ¢ÃƒÆ’Ã†â€™Ãƒâ€šÃ‚Â¢ÃƒÆ’Ã‚Â¢ÃƒÂ¢Ã¢â€šÂ¬Ã…Â¡Ãƒâ€šÃ‚Â¬ÃƒÆ’Ã¢â‚¬Å¡Ãƒâ€šÃ‚Â ÃƒÆ’Ã†â€™Ãƒâ€ Ã¢â‚¬â„¢ÃƒÆ’Ã¢â‚¬Å¡Ãƒâ€šÃ‚Â¢ÃƒÆ’Ã†â€™Ãƒâ€šÃ‚Â¢ÃƒÆ’Ã‚Â¢ÃƒÂ¢Ã¢â‚¬Å¡Ã‚Â¬Ãƒâ€¦Ã‚Â¡ÃƒÆ’Ã¢â‚¬Å¡Ãƒâ€šÃ‚Â¬ÃƒÆ’Ã†â€™Ãƒâ€šÃ‚Â¢ÃƒÆ’Ã‚Â¢ÃƒÂ¢Ã¢â‚¬Å¡Ã‚Â¬Ãƒâ€¦Ã‚Â¾ÃƒÆ’Ã¢â‚¬Å¡Ãƒâ€šÃ‚Â¢ÃƒÆ’Ã†â€™Ãƒâ€ Ã¢â‚¬â„¢ÃƒÆ’Ã¢â‚¬Â ÃƒÂ¢Ã¢â€šÂ¬Ã¢â€žÂ¢ÃƒÆ’Ã†â€™ÃƒÂ¢Ã¢â€šÂ¬Ã‚Â ÃƒÆ’Ã‚Â¢ÃƒÂ¢Ã¢â‚¬Å¡Ã‚Â¬ÃƒÂ¢Ã¢â‚¬Å¾Ã‚Â¢ÃƒÆ’Ã†â€™Ãƒâ€ Ã¢â‚¬â„¢ÃƒÆ’Ã¢â‚¬Å¡Ãƒâ€šÃ‚Â¢ÃƒÆ’Ã†â€™Ãƒâ€šÃ‚Â¢ÃƒÆ’Ã‚Â¢ÃƒÂ¢Ã¢â‚¬Å¡Ã‚Â¬Ãƒâ€¦Ã‚Â¡ÃƒÆ’Ã¢â‚¬Å¡Ãƒâ€šÃ‚Â¬ÃƒÆ’Ã†â€™ÃƒÂ¢Ã¢â€šÂ¬Ã‚Â¦ÃƒÆ’Ã¢â‚¬Å¡Ãƒâ€šÃ‚Â¡ÃƒÆ’Ã†â€™Ãƒâ€ Ã¢â‚¬â„¢ÃƒÆ’Ã¢â‚¬Â ÃƒÂ¢Ã¢â€šÂ¬Ã¢â€žÂ¢ÃƒÆ’Ã†â€™Ãƒâ€šÃ‚Â¢ÃƒÆ’Ã‚Â¢ÃƒÂ¢Ã¢â€šÂ¬Ã…Â¡Ãƒâ€šÃ‚Â¬ÃƒÆ’Ã¢â‚¬Â¦Ãƒâ€šÃ‚Â¡ÃƒÆ’Ã†â€™Ãƒâ€ Ã¢â‚¬â„¢ÃƒÆ’Ã‚Â¢ÃƒÂ¢Ã¢â‚¬Å¡Ã‚Â¬Ãƒâ€¦Ã‚Â¡ÃƒÆ’Ã†â€™ÃƒÂ¢Ã¢â€šÂ¬Ã…Â¡ÃƒÆ’Ã¢â‚¬Å¡Ãƒâ€šÃ‚Â¢ÃƒÆ’Ã†â€™Ãƒâ€ Ã¢â‚¬â„¢ÃƒÆ’Ã¢â‚¬Â ÃƒÂ¢Ã¢â€šÂ¬Ã¢â€žÂ¢ÃƒÆ’Ã†â€™ÃƒÂ¢Ã¢â€šÂ¬Ã‚Â ÃƒÆ’Ã‚Â¢ÃƒÂ¢Ã¢â‚¬Å¡Ã‚Â¬ÃƒÂ¢Ã¢â‚¬Å¾Ã‚Â¢ÃƒÆ’Ã†â€™Ãƒâ€ Ã¢â‚¬â„¢ÃƒÆ’Ã‚Â¢ÃƒÂ¢Ã¢â‚¬Å¡Ã‚Â¬Ãƒâ€šÃ‚Â ÃƒÆ’Ã†â€™Ãƒâ€šÃ‚Â¢ÃƒÆ’Ã‚Â¢ÃƒÂ¢Ã¢â€šÂ¬Ã…Â¡Ãƒâ€šÃ‚Â¬ÃƒÆ’Ã‚Â¢ÃƒÂ¢Ã¢â€šÂ¬Ã…Â¾Ãƒâ€šÃ‚Â¢ÃƒÆ’Ã†â€™Ãƒâ€ Ã¢â‚¬â„¢ÃƒÆ’Ã¢â‚¬Â ÃƒÂ¢Ã¢â€šÂ¬Ã¢â€žÂ¢ÃƒÆ’Ã†â€™Ãƒâ€šÃ‚Â¢ÃƒÆ’Ã‚Â¢ÃƒÂ¢Ã¢â€šÂ¬Ã…Â¡Ãƒâ€šÃ‚Â¬ÃƒÆ’Ã¢â‚¬Â¦Ãƒâ€šÃ‚Â¡ÃƒÆ’Ã†â€™Ãƒâ€ Ã¢â‚¬â„¢ÃƒÆ’Ã‚Â¢ÃƒÂ¢Ã¢â‚¬Å¡Ã‚Â¬Ãƒâ€¦Ã‚Â¡ÃƒÆ’Ã†â€™ÃƒÂ¢Ã¢â€šÂ¬Ã…Â¡ÃƒÆ’Ã¢â‚¬Å¡Ãƒâ€šÃ‚Â¢ÃƒÆ’Ã†â€™Ãƒâ€ Ã¢â‚¬â„¢ÃƒÆ’Ã¢â‚¬Â ÃƒÂ¢Ã¢â€šÂ¬Ã¢â€žÂ¢ÃƒÆ’Ã†â€™ÃƒÂ¢Ã¢â€šÂ¬Ã‚Â ÃƒÆ’Ã‚Â¢ÃƒÂ¢Ã¢â‚¬Å¡Ã‚Â¬ÃƒÂ¢Ã¢â‚¬Å¾Ã‚Â¢ÃƒÆ’Ã†â€™Ãƒâ€ Ã¢â‚¬â„¢ÃƒÆ’Ã‚Â¢ÃƒÂ¢Ã¢â‚¬Å¡Ã‚Â¬Ãƒâ€¦Ã‚Â¡ÃƒÆ’Ã†â€™ÃƒÂ¢Ã¢â€šÂ¬Ã…Â¡ÃƒÆ’Ã¢â‚¬Å¡Ãƒâ€šÃ‚Â¢ÃƒÆ’Ã†â€™Ãƒâ€ Ã¢â‚¬â„¢ÃƒÆ’Ã¢â‚¬Â ÃƒÂ¢Ã¢â€šÂ¬Ã¢â€žÂ¢ÃƒÆ’Ã†â€™ÃƒÂ¢Ã¢â€šÂ¬Ã…Â¡ÃƒÆ’Ã¢â‚¬Å¡Ãƒâ€šÃ‚Â¢ÃƒÆ’Ã†â€™Ãƒâ€ Ã¢â‚¬â„¢ÃƒÆ’Ã¢â‚¬Å¡Ãƒâ€šÃ‚Â¢ÃƒÆ’Ã†â€™Ãƒâ€šÃ‚Â¢ÃƒÆ’Ã‚Â¢ÃƒÂ¢Ã¢â‚¬Å¡Ã‚Â¬Ãƒâ€¦Ã‚Â¡ÃƒÆ’Ã¢â‚¬Å¡Ãƒâ€šÃ‚Â¬ÃƒÆ’Ã†â€™ÃƒÂ¢Ã¢â€šÂ¬Ã‚Â¦ÃƒÆ’Ã¢â‚¬Å¡Ãƒâ€šÃ‚Â¡ÃƒÆ’Ã†â€™Ãƒâ€ Ã¢â‚¬â„¢ÃƒÆ’Ã‚Â¢ÃƒÂ¢Ã¢â‚¬Å¡Ã‚Â¬Ãƒâ€¦Ã‚Â¡ÃƒÆ’Ã†â€™ÃƒÂ¢Ã¢â€šÂ¬Ã…Â¡ÃƒÆ’Ã¢â‚¬Å¡Ãƒâ€šÃ‚Â¬ÃƒÆ’Ã†â€™Ãƒâ€ Ã¢â‚¬â„¢ÃƒÆ’Ã¢â‚¬Â ÃƒÂ¢Ã¢â€šÂ¬Ã¢â€žÂ¢ÃƒÆ’Ã†â€™Ãƒâ€šÃ‚Â¢ÃƒÆ’Ã‚Â¢ÃƒÂ¢Ã¢â€šÂ¬Ã…Â¡Ãƒâ€šÃ‚Â¬ÃƒÆ’Ã¢â‚¬Å¡Ãƒâ€šÃ‚Â¦ÃƒÆ’Ã†â€™Ãƒâ€ Ã¢â‚¬â„¢ÃƒÆ’Ã‚Â¢ÃƒÂ¢Ã¢â‚¬Å¡Ã‚Â¬Ãƒâ€¦Ã‚Â¡ÃƒÆ’Ã†â€™ÃƒÂ¢Ã¢â€šÂ¬Ã…Â¡ÃƒÆ’Ã¢â‚¬Å¡Ãƒâ€šÃ‚Â¡ÃƒÆ’Ã†â€™Ãƒâ€ Ã¢â‚¬â„¢ÃƒÆ’Ã¢â‚¬Â ÃƒÂ¢Ã¢â€šÂ¬Ã¢â€žÂ¢ÃƒÆ’Ã†â€™ÃƒÂ¢Ã¢â€šÂ¬Ã‚Â ÃƒÆ’Ã‚Â¢ÃƒÂ¢Ã¢â‚¬Å¡Ã‚Â¬ÃƒÂ¢Ã¢â‚¬Å¾Ã‚Â¢ÃƒÆ’Ã†â€™Ãƒâ€ Ã¢â‚¬â„¢ÃƒÆ’Ã¢â‚¬Å¡Ãƒâ€šÃ‚Â¢ÃƒÆ’Ã†â€™Ãƒâ€šÃ‚Â¢ÃƒÆ’Ã‚Â¢ÃƒÂ¢Ã¢â‚¬Å¡Ã‚Â¬Ãƒâ€¦Ã‚Â¡ÃƒÆ’Ã¢â‚¬Å¡Ãƒâ€šÃ‚Â¬ÃƒÆ’Ã†â€™ÃƒÂ¢Ã¢â€šÂ¬Ã‚Â¦ÃƒÆ’Ã¢â‚¬Å¡Ãƒâ€šÃ‚Â¡ÃƒÆ’Ã†â€™Ãƒâ€ Ã¢â‚¬â„¢ÃƒÆ’Ã¢â‚¬Â ÃƒÂ¢Ã¢â€šÂ¬Ã¢â€žÂ¢ÃƒÆ’Ã†â€™Ãƒâ€šÃ‚Â¢ÃƒÆ’Ã‚Â¢ÃƒÂ¢Ã¢â€šÂ¬Ã…Â¡Ãƒâ€šÃ‚Â¬ÃƒÆ’Ã¢â‚¬Â¦Ãƒâ€šÃ‚Â¡ÃƒÆ’Ã†â€™Ãƒâ€ Ã¢â‚¬â„¢ÃƒÆ’Ã‚Â¢ÃƒÂ¢Ã¢â‚¬Å¡Ã‚Â¬Ãƒâ€¦Ã‚Â¡ÃƒÆ’Ã†â€™ÃƒÂ¢Ã¢â€šÂ¬Ã…Â¡ÃƒÆ’Ã¢â‚¬Å¡Ãƒâ€šÃ‚Â¬ÃƒÆ’Ã†â€™Ãƒâ€ Ã¢â‚¬â„¢ÃƒÆ’Ã¢â‚¬Â ÃƒÂ¢Ã¢â€šÂ¬Ã¢â€žÂ¢ÃƒÆ’Ã†â€™ÃƒÂ¢Ã¢â€šÂ¬Ã‚Â ÃƒÆ’Ã‚Â¢ÃƒÂ¢Ã¢â‚¬Å¡Ã‚Â¬ÃƒÂ¢Ã¢â‚¬Å¾Ã‚Â¢ÃƒÆ’Ã†â€™Ãƒâ€ Ã¢â‚¬â„¢ÃƒÆ’Ã‚Â¢ÃƒÂ¢Ã¢â‚¬Å¡Ã‚Â¬Ãƒâ€šÃ‚Â ÃƒÆ’Ã†â€™Ãƒâ€šÃ‚Â¢ÃƒÆ’Ã‚Â¢ÃƒÂ¢Ã¢â€šÂ¬Ã…Â¡Ãƒâ€šÃ‚Â¬ÃƒÆ’Ã‚Â¢ÃƒÂ¢Ã¢â€šÂ¬Ã…Â¾Ãƒâ€šÃ‚Â¢ÃƒÆ’Ã†â€™Ãƒâ€ Ã¢â‚¬â„¢ÃƒÆ’Ã¢â‚¬Â ÃƒÂ¢Ã¢â€šÂ¬Ã¢â€žÂ¢ÃƒÆ’Ã†â€™ÃƒÂ¢Ã¢â€šÂ¬Ã…Â¡ÃƒÆ’Ã¢â‚¬Å¡Ãƒâ€šÃ‚Â¢ÃƒÆ’Ã†â€™Ãƒâ€ Ã¢â‚¬â„¢ÃƒÆ’Ã¢â‚¬Å¡Ãƒâ€šÃ‚Â¢ÃƒÆ’Ã†â€™Ãƒâ€šÃ‚Â¢ÃƒÆ’Ã‚Â¢ÃƒÂ¢Ã¢â€šÂ¬Ã…Â¡Ãƒâ€šÃ‚Â¬ÃƒÆ’Ã¢â‚¬Â¦Ãƒâ€šÃ‚Â¡ÃƒÆ’Ã†â€™ÃƒÂ¢Ã¢â€šÂ¬Ã…Â¡ÃƒÆ’Ã¢â‚¬Å¡Ãƒâ€šÃ‚Â¬ÃƒÆ’Ã†â€™Ãƒâ€ Ã¢â‚¬â„¢ÃƒÆ’Ã‚Â¢ÃƒÂ¢Ã¢â‚¬Å¡Ã‚Â¬Ãƒâ€¦Ã‚Â¡ÃƒÆ’Ã†â€™ÃƒÂ¢Ã¢â€šÂ¬Ã…Â¡ÃƒÆ’Ã¢â‚¬Å¡Ãƒâ€šÃ‚Â¦ÃƒÆ’Ã†â€™Ãƒâ€ Ã¢â‚¬â„¢ÃƒÆ’Ã¢â‚¬Â ÃƒÂ¢Ã¢â€šÂ¬Ã¢â€žÂ¢ÃƒÆ’Ã†â€™ÃƒÂ¢Ã¢â€šÂ¬Ã‚Â ÃƒÆ’Ã‚Â¢ÃƒÂ¢Ã¢â‚¬Å¡Ã‚Â¬ÃƒÂ¢Ã¢â‚¬Å¾Ã‚Â¢ÃƒÆ’Ã†â€™Ãƒâ€ Ã¢â‚¬â„¢ÃƒÆ’Ã‚Â¢ÃƒÂ¢Ã¢â‚¬Å¡Ã‚Â¬Ãƒâ€¦Ã‚Â¡ÃƒÆ’Ã†â€™ÃƒÂ¢Ã¢â€šÂ¬Ã…Â¡ÃƒÆ’Ã¢â‚¬Å¡Ãƒâ€šÃ‚Â¢ÃƒÆ’Ã†â€™Ãƒâ€ Ã¢â‚¬â„¢ÃƒÆ’Ã¢â‚¬Â ÃƒÂ¢Ã¢â€šÂ¬Ã¢â€žÂ¢ÃƒÆ’Ã†â€™ÃƒÂ¢Ã¢â€šÂ¬Ã…Â¡ÃƒÆ’Ã¢â‚¬Å¡Ãƒâ€šÃ‚Â¢ÃƒÆ’Ã†â€™Ãƒâ€ Ã¢â‚¬â„¢ÃƒÆ’Ã¢â‚¬Å¡Ãƒâ€šÃ‚Â¢ÃƒÆ’Ã†â€™Ãƒâ€šÃ‚Â¢ÃƒÆ’Ã‚Â¢ÃƒÂ¢Ã¢â‚¬Å¡Ã‚Â¬Ãƒâ€¦Ã‚Â¡ÃƒÆ’Ã¢â‚¬Å¡Ãƒâ€šÃ‚Â¬ÃƒÆ’Ã†â€™ÃƒÂ¢Ã¢â€šÂ¬Ã‚Â¦ÃƒÆ’Ã¢â‚¬Å¡Ãƒâ€šÃ‚Â¡ÃƒÆ’Ã†â€™Ãƒâ€ Ã¢â‚¬â„¢ÃƒÆ’Ã‚Â¢ÃƒÂ¢Ã¢â‚¬Å¡Ã‚Â¬Ãƒâ€¦Ã‚Â¡ÃƒÆ’Ã†â€™ÃƒÂ¢Ã¢â€šÂ¬Ã…Â¡ÃƒÆ’Ã¢â‚¬Å¡Ãƒâ€šÃ‚Â¬ÃƒÆ’Ã†â€™Ãƒâ€ Ã¢â‚¬â„¢ÃƒÆ’Ã¢â‚¬Â ÃƒÂ¢Ã¢â€šÂ¬Ã¢â€žÂ¢ÃƒÆ’Ã†â€™Ãƒâ€šÃ‚Â¢ÃƒÆ’Ã‚Â¢ÃƒÂ¢Ã¢â€šÂ¬Ã…Â¡Ãƒâ€šÃ‚Â¬ÃƒÆ’Ã¢â‚¬Å¡Ãƒâ€šÃ‚Â¦ÃƒÆ’Ã†â€™Ãƒâ€ Ã¢â‚¬â„¢ÃƒÆ’Ã¢â‚¬Å¡Ãƒâ€šÃ‚Â¢ÃƒÆ’Ã†â€™Ãƒâ€šÃ‚Â¢ÃƒÆ’Ã‚Â¢ÃƒÂ¢Ã¢â‚¬Å¡Ã‚Â¬Ãƒâ€¦Ã‚Â¡ÃƒÆ’Ã¢â‚¬Å¡Ãƒâ€šÃ‚Â¬ÃƒÆ’Ã†â€™ÃƒÂ¢Ã¢â€šÂ¬Ã‚Â¦ÃƒÆ’Ã‚Â¢ÃƒÂ¢Ã¢â‚¬Å¡Ã‚Â¬Ãƒâ€¦Ã¢â‚¬Å“Wk5 interval, where the IMTA system remained relatively stable with a minor decline (-0.668%/day), while the Monoculture system experienced a sharp drop in growth (-9.516%/day), indicating strong physiological stress. In the final phase (Wk5ÃƒÆ’Ã†â€™Ãƒâ€ Ã¢â‚¬â„¢ÃƒÆ’Ã¢â‚¬Â ÃƒÂ¢Ã¢â€šÂ¬Ã¢â€žÂ¢ÃƒÆ’Ã†â€™ÃƒÂ¢Ã¢â€šÂ¬Ã‚Â ÃƒÆ’Ã‚Â¢ÃƒÂ¢Ã¢â‚¬Å¡Ã‚Â¬ÃƒÂ¢Ã¢â‚¬Å¾Ã‚Â¢ÃƒÆ’Ã†â€™Ãƒâ€ Ã¢â‚¬â„¢ÃƒÆ’Ã‚Â¢ÃƒÂ¢Ã¢â‚¬Å¡Ã‚Â¬Ãƒâ€šÃ‚Â ÃƒÆ’Ã†â€™Ãƒâ€šÃ‚Â¢ÃƒÆ’Ã‚Â¢ÃƒÂ¢Ã¢â€šÂ¬Ã…Â¡Ãƒâ€šÃ‚Â¬ÃƒÆ’Ã‚Â¢ÃƒÂ¢Ã¢â€šÂ¬Ã…Â¾Ãƒâ€šÃ‚Â¢ÃƒÆ’Ã†â€™Ãƒâ€ Ã¢â‚¬â„¢ÃƒÆ’Ã¢â‚¬Â ÃƒÂ¢Ã¢â€šÂ¬Ã¢â€žÂ¢ÃƒÆ’Ã†â€™Ãƒâ€šÃ‚Â¢ÃƒÆ’Ã‚Â¢ÃƒÂ¢Ã¢â€šÂ¬Ã…Â¡Ãƒâ€šÃ‚Â¬ÃƒÆ’Ã¢â‚¬Å¡Ãƒâ€šÃ‚Â ÃƒÆ’Ã†â€™Ãƒâ€ Ã¢â‚¬â„¢ÃƒÆ’Ã¢â‚¬Å¡Ãƒâ€šÃ‚Â¢ÃƒÆ’Ã†â€™Ãƒâ€šÃ‚Â¢ÃƒÆ’Ã‚Â¢ÃƒÂ¢Ã¢â‚¬Å¡Ã‚Â¬Ãƒâ€¦Ã‚Â¡ÃƒÆ’Ã¢â‚¬Å¡Ãƒâ€šÃ‚Â¬ÃƒÆ’Ã†â€™Ãƒâ€šÃ‚Â¢ÃƒÆ’Ã‚Â¢ÃƒÂ¢Ã¢â‚¬Å¡Ã‚Â¬Ãƒâ€¦Ã‚Â¾ÃƒÆ’Ã¢â‚¬Å¡Ãƒâ€šÃ‚Â¢ÃƒÆ’Ã†â€™Ãƒâ€ Ã¢â‚¬â„¢ÃƒÆ’Ã¢â‚¬Â ÃƒÂ¢Ã¢â€šÂ¬Ã¢â€žÂ¢ÃƒÆ’Ã†â€™ÃƒÂ¢Ã¢â€šÂ¬Ã‚Â ÃƒÆ’Ã‚Â¢ÃƒÂ¢Ã¢â‚¬Å¡Ã‚Â¬ÃƒÂ¢Ã¢â‚¬Å¾Ã‚Â¢ÃƒÆ’Ã†â€™Ãƒâ€ Ã¢â‚¬â„¢ÃƒÆ’Ã¢â‚¬Å¡Ãƒâ€šÃ‚Â¢ÃƒÆ’Ã†â€™Ãƒâ€šÃ‚Â¢ÃƒÆ’Ã‚Â¢ÃƒÂ¢Ã¢â‚¬Å¡Ã‚Â¬Ãƒâ€¦Ã‚Â¡ÃƒÆ’Ã¢â‚¬Å¡Ãƒâ€šÃ‚Â¬ÃƒÆ’Ã†â€™ÃƒÂ¢Ã¢â€šÂ¬Ã…Â¡ÃƒÆ’Ã¢â‚¬Å¡Ãƒâ€šÃ‚Â ÃƒÆ’Ã†â€™Ãƒâ€ Ã¢â‚¬â„¢ÃƒÆ’Ã¢â‚¬Â ÃƒÂ¢Ã¢â€šÂ¬Ã¢â€žÂ¢ÃƒÆ’Ã†â€™ÃƒÂ¢Ã¢â€šÂ¬Ã…Â¡ÃƒÆ’Ã¢â‚¬Å¡Ãƒâ€šÃ‚Â¢ÃƒÆ’Ã†â€™Ãƒâ€ Ã¢â‚¬â„¢ÃƒÆ’Ã¢â‚¬Å¡Ãƒâ€šÃ‚Â¢ÃƒÆ’Ã†â€™Ãƒâ€šÃ‚Â¢ÃƒÆ’Ã‚Â¢ÃƒÂ¢Ã¢â€šÂ¬Ã…Â¡Ãƒâ€šÃ‚Â¬ÃƒÆ’Ã¢â‚¬Â¦Ãƒâ€šÃ‚Â¡ÃƒÆ’Ã†â€™ÃƒÂ¢Ã¢â€šÂ¬Ã…Â¡ÃƒÆ’Ã¢â‚¬Å¡Ãƒâ€šÃ‚Â¬ÃƒÆ’Ã†â€™Ãƒâ€ Ã¢â‚¬â„¢ÃƒÆ’Ã¢â‚¬Å¡Ãƒâ€šÃ‚Â¢ÃƒÆ’Ã†â€™Ãƒâ€šÃ‚Â¢ÃƒÆ’Ã‚Â¢ÃƒÂ¢Ã¢â€šÂ¬Ã…Â¡Ãƒâ€šÃ‚Â¬ÃƒÆ’Ã¢â‚¬Â¦Ãƒâ€šÃ‚Â¾ÃƒÆ’Ã†â€™ÃƒÂ¢Ã¢â€šÂ¬Ã…Â¡ÃƒÆ’Ã¢â‚¬Å¡Ãƒâ€šÃ‚Â¢ÃƒÆ’Ã†â€™Ãƒâ€ Ã¢â‚¬â„¢ÃƒÆ’Ã¢â‚¬Â ÃƒÂ¢Ã¢â€šÂ¬Ã¢â€žÂ¢ÃƒÆ’Ã†â€™ÃƒÂ¢Ã¢â€šÂ¬Ã‚Â ÃƒÆ’Ã‚Â¢ÃƒÂ¢Ã¢â‚¬Å¡Ã‚Â¬ÃƒÂ¢Ã¢â‚¬Å¾Ã‚Â¢ÃƒÆ’Ã†â€™Ãƒâ€ Ã¢â‚¬â„¢ÃƒÆ’Ã‚Â¢ÃƒÂ¢Ã¢â‚¬Å¡Ã‚Â¬Ãƒâ€šÃ‚Â ÃƒÆ’Ã†â€™Ãƒâ€šÃ‚Â¢ÃƒÆ’Ã‚Â¢ÃƒÂ¢Ã¢â€šÂ¬Ã…Â¡Ãƒâ€šÃ‚Â¬ÃƒÆ’Ã‚Â¢ÃƒÂ¢Ã¢â€šÂ¬Ã…Â¾Ãƒâ€šÃ‚Â¢ÃƒÆ’Ã†â€™Ãƒâ€ Ã¢â‚¬â„¢ÃƒÆ’Ã¢â‚¬Â ÃƒÂ¢Ã¢â€šÂ¬Ã¢â€žÂ¢ÃƒÆ’Ã†â€™ÃƒÂ¢Ã¢â€šÂ¬Ã…Â¡ÃƒÆ’Ã¢â‚¬Å¡Ãƒâ€šÃ‚Â¢ÃƒÆ’Ã†â€™Ãƒâ€ Ã¢â‚¬â„¢ÃƒÆ’Ã¢â‚¬Å¡Ãƒâ€šÃ‚Â¢ÃƒÆ’Ã†â€™Ãƒâ€šÃ‚Â¢ÃƒÆ’Ã‚Â¢ÃƒÂ¢Ã¢â€šÂ¬Ã…Â¡Ãƒâ€šÃ‚Â¬ÃƒÆ’Ã¢â‚¬Â¦Ãƒâ€šÃ‚Â¡ÃƒÆ’Ã†â€™ÃƒÂ¢Ã¢â€šÂ¬Ã…Â¡ÃƒÆ’Ã¢â‚¬Å¡Ãƒâ€šÃ‚Â¬ÃƒÆ’Ã†â€™Ãƒâ€ Ã¢â‚¬â„¢ÃƒÆ’Ã‚Â¢ÃƒÂ¢Ã¢â‚¬Å¡Ã‚Â¬Ãƒâ€šÃ‚Â¦ÃƒÆ’Ã†â€™ÃƒÂ¢Ã¢â€šÂ¬Ã…Â¡ÃƒÆ’Ã¢â‚¬Å¡Ãƒâ€šÃ‚Â¡ÃƒÆ’Ã†â€™Ãƒâ€ Ã¢â‚¬â„¢ÃƒÆ’Ã¢â‚¬Â ÃƒÂ¢Ã¢â€šÂ¬Ã¢â€žÂ¢ÃƒÆ’Ã†â€™ÃƒÂ¢Ã¢â€šÂ¬Ã‚Â ÃƒÆ’Ã‚Â¢ÃƒÂ¢Ã¢â‚¬Å¡Ã‚Â¬ÃƒÂ¢Ã¢â‚¬Å¾Ã‚Â¢ÃƒÆ’Ã†â€™Ãƒâ€ Ã¢â‚¬â„¢ÃƒÆ’Ã¢â‚¬Å¡Ãƒâ€šÃ‚Â¢ÃƒÆ’Ã†â€™Ãƒâ€šÃ‚Â¢ÃƒÆ’Ã‚Â¢ÃƒÂ¢Ã¢â‚¬Å¡Ã‚Â¬Ãƒâ€¦Ã‚Â¡ÃƒÆ’Ã¢â‚¬Å¡Ãƒâ€šÃ‚Â¬ÃƒÆ’Ã†â€™ÃƒÂ¢Ã¢â€šÂ¬Ã‚Â¦ÃƒÆ’Ã¢â‚¬Å¡Ãƒâ€šÃ‚Â¡ÃƒÆ’Ã†â€™Ãƒâ€ Ã¢â‚¬â„¢ÃƒÆ’Ã¢â‚¬Â ÃƒÂ¢Ã¢â€šÂ¬Ã¢â€žÂ¢ÃƒÆ’Ã†â€™Ãƒâ€šÃ‚Â¢ÃƒÆ’Ã‚Â¢ÃƒÂ¢Ã¢â€šÂ¬Ã…Â¡Ãƒâ€šÃ‚Â¬ÃƒÆ’Ã¢â‚¬Â¦Ãƒâ€šÃ‚Â¡ÃƒÆ’Ã†â€™Ãƒâ€ Ã¢â‚¬â„¢ÃƒÆ’Ã‚Â¢ÃƒÂ¢Ã¢â‚¬Å¡Ã‚Â¬Ãƒâ€¦Ã‚Â¡ÃƒÆ’Ã†â€™ÃƒÂ¢Ã¢â€šÂ¬Ã…Â¡ÃƒÆ’Ã¢â‚¬Å¡Ãƒâ€šÃ‚Â¢ÃƒÆ’Ã†â€™Ãƒâ€ Ã¢â‚¬â„¢ÃƒÆ’Ã¢â‚¬Â ÃƒÂ¢Ã¢â€šÂ¬Ã¢â€žÂ¢ÃƒÆ’Ã†â€™ÃƒÂ¢Ã¢â€šÂ¬Ã‚Â ÃƒÆ’Ã‚Â¢ÃƒÂ¢Ã¢â‚¬Å¡Ã‚Â¬ÃƒÂ¢Ã¢â‚¬Å¾Ã‚Â¢ÃƒÆ’Ã†â€™Ãƒâ€ Ã¢â‚¬â„¢ÃƒÆ’Ã‚Â¢ÃƒÂ¢Ã¢â‚¬Å¡Ã‚Â¬Ãƒâ€šÃ‚Â ÃƒÆ’Ã†â€™Ãƒâ€šÃ‚Â¢ÃƒÆ’Ã‚Â¢ÃƒÂ¢Ã¢â€šÂ¬Ã…Â¡Ãƒâ€šÃ‚Â¬ÃƒÆ’Ã‚Â¢ÃƒÂ¢Ã¢â€šÂ¬Ã…Â¾Ãƒâ€šÃ‚Â¢ÃƒÆ’Ã†â€™Ãƒâ€ Ã¢â‚¬â„¢ÃƒÆ’Ã¢â‚¬Â ÃƒÂ¢Ã¢â€šÂ¬Ã¢â€žÂ¢ÃƒÆ’Ã†â€™Ãƒâ€šÃ‚Â¢ÃƒÆ’Ã‚Â¢ÃƒÂ¢Ã¢â€šÂ¬Ã…Â¡Ãƒâ€šÃ‚Â¬ÃƒÆ’Ã¢â‚¬Å¡Ãƒâ€šÃ‚Â ÃƒÆ’Ã†â€™Ãƒâ€ Ã¢â‚¬â„¢ÃƒÆ’Ã¢â‚¬Å¡Ãƒâ€šÃ‚Â¢ÃƒÆ’Ã†â€™Ãƒâ€šÃ‚Â¢ÃƒÆ’Ã‚Â¢ÃƒÂ¢Ã¢â‚¬Å¡Ã‚Â¬Ãƒâ€¦Ã‚Â¡ÃƒÆ’Ã¢â‚¬Å¡Ãƒâ€šÃ‚Â¬ÃƒÆ’Ã†â€™Ãƒâ€šÃ‚Â¢ÃƒÆ’Ã‚Â¢ÃƒÂ¢Ã¢â‚¬Å¡Ã‚Â¬Ãƒâ€¦Ã‚Â¾ÃƒÆ’Ã¢â‚¬Å¡Ãƒâ€šÃ‚Â¢ÃƒÆ’Ã†â€™Ãƒâ€ Ã¢â‚¬â„¢ÃƒÆ’Ã¢â‚¬Â ÃƒÂ¢Ã¢â€šÂ¬Ã¢â€žÂ¢ÃƒÆ’Ã†â€™ÃƒÂ¢Ã¢â€šÂ¬Ã‚Â ÃƒÆ’Ã‚Â¢ÃƒÂ¢Ã¢â‚¬Å¡Ã‚Â¬ÃƒÂ¢Ã¢â‚¬Å¾Ã‚Â¢ÃƒÆ’Ã†â€™Ãƒâ€ Ã¢â‚¬â„¢ÃƒÆ’Ã¢â‚¬Å¡Ãƒâ€šÃ‚Â¢ÃƒÆ’Ã†â€™Ãƒâ€šÃ‚Â¢ÃƒÆ’Ã‚Â¢ÃƒÂ¢Ã¢â‚¬Å¡Ã‚Â¬Ãƒâ€¦Ã‚Â¡ÃƒÆ’Ã¢â‚¬Å¡Ãƒâ€šÃ‚Â¬ÃƒÆ’Ã†â€™ÃƒÂ¢Ã¢â€šÂ¬Ã‚Â¦ÃƒÆ’Ã¢â‚¬Å¡Ãƒâ€šÃ‚Â¡ÃƒÆ’Ã†â€™Ãƒâ€ Ã¢â‚¬â„¢ÃƒÆ’Ã¢â‚¬Â ÃƒÂ¢Ã¢â€šÂ¬Ã¢â€žÂ¢ÃƒÆ’Ã†â€™Ãƒâ€šÃ‚Â¢ÃƒÆ’Ã‚Â¢ÃƒÂ¢Ã¢â€šÂ¬Ã…Â¡Ãƒâ€šÃ‚Â¬ÃƒÆ’Ã¢â‚¬Â¦Ãƒâ€šÃ‚Â¡ÃƒÆ’Ã†â€™Ãƒâ€ Ã¢â‚¬â„¢ÃƒÆ’Ã‚Â¢ÃƒÂ¢Ã¢â‚¬Å¡Ã‚Â¬Ãƒâ€¦Ã‚Â¡ÃƒÆ’Ã†â€™ÃƒÂ¢Ã¢â€šÂ¬Ã…Â¡ÃƒÆ’Ã¢â‚¬Å¡Ãƒâ€šÃ‚Â¢ÃƒÆ’Ã†â€™Ãƒâ€ Ã¢â‚¬â„¢ÃƒÆ’Ã¢â‚¬Â ÃƒÂ¢Ã¢â€šÂ¬Ã¢â€žÂ¢ÃƒÆ’Ã†â€™ÃƒÂ¢Ã¢â€šÂ¬Ã‚Â ÃƒÆ’Ã‚Â¢ÃƒÂ¢Ã¢â‚¬Å¡Ã‚Â¬ÃƒÂ¢Ã¢â‚¬Å¾Ã‚Â¢ÃƒÆ’Ã†â€™Ãƒâ€ Ã¢â‚¬â„¢ÃƒÆ’Ã‚Â¢ÃƒÂ¢Ã¢â‚¬Å¡Ã‚Â¬Ãƒâ€šÃ‚Â ÃƒÆ’Ã†â€™Ãƒâ€šÃ‚Â¢ÃƒÆ’Ã‚Â¢ÃƒÂ¢Ã¢â€šÂ¬Ã…Â¡Ãƒâ€šÃ‚Â¬ÃƒÆ’Ã‚Â¢ÃƒÂ¢Ã¢â€šÂ¬Ã…Â¾Ãƒâ€šÃ‚Â¢ÃƒÆ’Ã†â€™Ãƒâ€ Ã¢â‚¬â„¢ÃƒÆ’Ã¢â‚¬Â ÃƒÂ¢Ã¢â€šÂ¬Ã¢â€žÂ¢ÃƒÆ’Ã†â€™Ãƒâ€šÃ‚Â¢ÃƒÆ’Ã‚Â¢ÃƒÂ¢Ã¢â€šÂ¬Ã…Â¡Ãƒâ€šÃ‚Â¬ÃƒÆ’Ã¢â‚¬Â¦Ãƒâ€šÃ‚Â¡ÃƒÆ’Ã†â€™Ãƒâ€ Ã¢â‚¬â„¢ÃƒÆ’Ã‚Â¢ÃƒÂ¢Ã¢â‚¬Å¡Ã‚Â¬Ãƒâ€¦Ã‚Â¡ÃƒÆ’Ã†â€™ÃƒÂ¢Ã¢â€šÂ¬Ã…Â¡ÃƒÆ’Ã¢â‚¬Å¡Ãƒâ€šÃ‚Â¢ÃƒÆ’Ã†â€™Ãƒâ€ Ã¢â‚¬â„¢ÃƒÆ’Ã¢â‚¬Â ÃƒÂ¢Ã¢â€šÂ¬Ã¢â€žÂ¢ÃƒÆ’Ã†â€™ÃƒÂ¢Ã¢â€šÂ¬Ã‚Â ÃƒÆ’Ã‚Â¢ÃƒÂ¢Ã¢â‚¬Å¡Ã‚Â¬ÃƒÂ¢Ã¢â‚¬Å¾Ã‚Â¢ÃƒÆ’Ã†â€™Ãƒâ€ Ã¢â‚¬â„¢ÃƒÆ’Ã‚Â¢ÃƒÂ¢Ã¢â‚¬Å¡Ã‚Â¬Ãƒâ€¦Ã‚Â¡ÃƒÆ’Ã†â€™ÃƒÂ¢Ã¢â€šÂ¬Ã…Â¡ÃƒÆ’Ã¢â‚¬Å¡Ãƒâ€šÃ‚Â¢ÃƒÆ’Ã†â€™Ãƒâ€ Ã¢â‚¬â„¢ÃƒÆ’Ã¢â‚¬Â ÃƒÂ¢Ã¢â€šÂ¬Ã¢â€žÂ¢ÃƒÆ’Ã†â€™ÃƒÂ¢Ã¢â€šÂ¬Ã…Â¡ÃƒÆ’Ã¢â‚¬Å¡Ãƒâ€šÃ‚Â¢ÃƒÆ’Ã†â€™Ãƒâ€ Ã¢â‚¬â„¢ÃƒÆ’Ã¢â‚¬Å¡Ãƒâ€šÃ‚Â¢ÃƒÆ’Ã†â€™Ãƒâ€šÃ‚Â¢ÃƒÆ’Ã‚Â¢ÃƒÂ¢Ã¢â€šÂ¬Ã…Â¡Ãƒâ€šÃ‚Â¬ÃƒÆ’Ã¢â‚¬Â¦Ãƒâ€šÃ‚Â¡ÃƒÆ’Ã†â€™ÃƒÂ¢Ã¢â€šÂ¬Ã…Â¡ÃƒÆ’Ã¢â‚¬Å¡Ãƒâ€šÃ‚Â¬ÃƒÆ’Ã†â€™Ãƒâ€ Ã¢â‚¬â„¢ÃƒÆ’Ã‚Â¢ÃƒÂ¢Ã¢â‚¬Å¡Ã‚Â¬Ãƒâ€šÃ‚Â¦ÃƒÆ’Ã†â€™ÃƒÂ¢Ã¢â€šÂ¬Ã…Â¡ÃƒÆ’Ã¢â‚¬Å¡Ãƒâ€šÃ‚Â¡ÃƒÆ’Ã†â€™Ãƒâ€ Ã¢â‚¬â„¢ÃƒÆ’Ã¢â‚¬Â ÃƒÂ¢Ã¢â€šÂ¬Ã¢â€žÂ¢ÃƒÆ’Ã†â€™Ãƒâ€šÃ‚Â¢ÃƒÆ’Ã‚Â¢ÃƒÂ¢Ã¢â€šÂ¬Ã…Â¡Ãƒâ€šÃ‚Â¬ÃƒÆ’Ã¢â‚¬Â¦Ãƒâ€šÃ‚Â¡ÃƒÆ’Ã†â€™Ãƒâ€ Ã¢â‚¬â„¢ÃƒÆ’Ã‚Â¢ÃƒÂ¢Ã¢â‚¬Å¡Ã‚Â¬Ãƒâ€¦Ã‚Â¡ÃƒÆ’Ã†â€™ÃƒÂ¢Ã¢â€šÂ¬Ã…Â¡ÃƒÆ’Ã¢â‚¬Å¡Ãƒâ€šÃ‚Â¬ÃƒÆ’Ã†â€™Ãƒâ€ Ã¢â‚¬â„¢ÃƒÆ’Ã¢â‚¬Â ÃƒÂ¢Ã¢â€šÂ¬Ã¢â€žÂ¢ÃƒÆ’Ã†â€™ÃƒÂ¢Ã¢â€šÂ¬Ã‚Â ÃƒÆ’Ã‚Â¢ÃƒÂ¢Ã¢â‚¬Å¡Ã‚Â¬ÃƒÂ¢Ã¢â‚¬Å¾Ã‚Â¢ÃƒÆ’Ã†â€™Ãƒâ€ Ã¢â‚¬â„¢ÃƒÆ’Ã¢â‚¬Å¡Ãƒâ€šÃ‚Â¢ÃƒÆ’Ã†â€™Ãƒâ€šÃ‚Â¢ÃƒÆ’Ã‚Â¢ÃƒÂ¢Ã¢â‚¬Å¡Ã‚Â¬Ãƒâ€¦Ã‚Â¡ÃƒÆ’Ã¢â‚¬Å¡Ãƒâ€šÃ‚Â¬ÃƒÆ’Ã†â€™ÃƒÂ¢Ã¢â€šÂ¬Ã…Â¡ÃƒÆ’Ã¢â‚¬Å¡Ãƒâ€šÃ‚Â¦ÃƒÆ’Ã†â€™Ãƒâ€ Ã¢â‚¬â„¢ÃƒÆ’Ã¢â‚¬Â ÃƒÂ¢Ã¢â€šÂ¬Ã¢â€žÂ¢ÃƒÆ’Ã†â€™Ãƒâ€šÃ‚Â¢ÃƒÆ’Ã‚Â¢ÃƒÂ¢Ã¢â€šÂ¬Ã…Â¡Ãƒâ€šÃ‚Â¬ÃƒÆ’Ã¢â‚¬Â¦Ãƒâ€šÃ‚Â¡ÃƒÆ’Ã†â€™Ãƒâ€ Ã¢â‚¬â„¢ÃƒÆ’Ã‚Â¢ÃƒÂ¢Ã¢â‚¬Å¡Ã‚Â¬Ãƒâ€¦Ã‚Â¡ÃƒÆ’Ã†â€™ÃƒÂ¢Ã¢â€šÂ¬Ã…Â¡ÃƒÆ’Ã¢â‚¬Å¡Ãƒâ€šÃ‚Â¡ÃƒÆ’Ã†â€™Ãƒâ€ Ã¢â‚¬â„¢ÃƒÆ’Ã¢â‚¬Â ÃƒÂ¢Ã¢â€šÂ¬Ã¢â€žÂ¢ÃƒÆ’Ã†â€™ÃƒÂ¢Ã¢â€šÂ¬Ã‚Â ÃƒÆ’Ã‚Â¢ÃƒÂ¢Ã¢â‚¬Å¡Ã‚Â¬ÃƒÂ¢Ã¢â‚¬Å¾Ã‚Â¢ÃƒÆ’Ã†â€™Ãƒâ€ Ã¢â‚¬â„¢ÃƒÆ’Ã‚Â¢ÃƒÂ¢Ã¢â‚¬Å¡Ã‚Â¬Ãƒâ€šÃ‚Â ÃƒÆ’Ã†â€™Ãƒâ€šÃ‚Â¢ÃƒÆ’Ã‚Â¢ÃƒÂ¢Ã¢â€šÂ¬Ã…Â¡Ãƒâ€šÃ‚Â¬ÃƒÆ’Ã‚Â¢ÃƒÂ¢Ã¢â€šÂ¬Ã…Â¾Ãƒâ€šÃ‚Â¢ÃƒÆ’Ã†â€™Ãƒâ€ Ã¢â‚¬â„¢ÃƒÆ’Ã¢â‚¬Â ÃƒÂ¢Ã¢â€šÂ¬Ã¢â€žÂ¢ÃƒÆ’Ã†â€™ÃƒÂ¢Ã¢â€šÂ¬Ã…Â¡ÃƒÆ’Ã¢â‚¬Å¡Ãƒâ€šÃ‚Â¢ÃƒÆ’Ã†â€™Ãƒâ€ Ã¢â‚¬â„¢ÃƒÆ’Ã¢â‚¬Å¡Ãƒâ€šÃ‚Â¢ÃƒÆ’Ã†â€™Ãƒâ€šÃ‚Â¢ÃƒÆ’Ã‚Â¢ÃƒÂ¢Ã¢â€šÂ¬Ã…Â¡Ãƒâ€šÃ‚Â¬ÃƒÆ’Ã¢â‚¬Â¦Ãƒâ€šÃ‚Â¡ÃƒÆ’Ã†â€™ÃƒÂ¢Ã¢â€šÂ¬Ã…Â¡ÃƒÆ’Ã¢â‚¬Å¡Ãƒâ€šÃ‚Â¬ÃƒÆ’Ã†â€™Ãƒâ€ Ã¢â‚¬â„¢ÃƒÆ’Ã‚Â¢ÃƒÂ¢Ã¢â‚¬Å¡Ã‚Â¬Ãƒâ€šÃ‚Â¦ÃƒÆ’Ã†â€™ÃƒÂ¢Ã¢â€šÂ¬Ã…Â¡ÃƒÆ’Ã¢â‚¬Å¡Ãƒâ€šÃ‚Â¡ÃƒÆ’Ã†â€™Ãƒâ€ Ã¢â‚¬â„¢ÃƒÆ’Ã¢â‚¬Â ÃƒÂ¢Ã¢â€šÂ¬Ã¢â€žÂ¢ÃƒÆ’Ã†â€™ÃƒÂ¢Ã¢â€šÂ¬Ã‚Â ÃƒÆ’Ã‚Â¢ÃƒÂ¢Ã¢â‚¬Å¡Ã‚Â¬ÃƒÂ¢Ã¢â‚¬Å¾Ã‚Â¢ÃƒÆ’Ã†â€™Ãƒâ€ Ã¢â‚¬â„¢ÃƒÆ’Ã¢â‚¬Å¡Ãƒâ€šÃ‚Â¢ÃƒÆ’Ã†â€™Ãƒâ€šÃ‚Â¢ÃƒÆ’Ã‚Â¢ÃƒÂ¢Ã¢â‚¬Å¡Ã‚Â¬Ãƒâ€¦Ã‚Â¡ÃƒÆ’Ã¢â‚¬Å¡Ãƒâ€šÃ‚Â¬ÃƒÆ’Ã†â€™ÃƒÂ¢Ã¢â€šÂ¬Ã‚Â¦ÃƒÆ’Ã¢â‚¬Å¡Ãƒâ€šÃ‚Â¡ÃƒÆ’Ã†â€™Ãƒâ€ Ã¢â‚¬â„¢ÃƒÆ’Ã¢â‚¬Â ÃƒÂ¢Ã¢â€šÂ¬Ã¢â€žÂ¢ÃƒÆ’Ã†â€™Ãƒâ€šÃ‚Â¢ÃƒÆ’Ã‚Â¢ÃƒÂ¢Ã¢â€šÂ¬Ã…Â¡Ãƒâ€šÃ‚Â¬ÃƒÆ’Ã¢â‚¬Â¦Ãƒâ€šÃ‚Â¡ÃƒÆ’Ã†â€™Ãƒâ€ Ã¢â‚¬â„¢ÃƒÆ’Ã‚Â¢ÃƒÂ¢Ã¢â‚¬Å¡Ã‚Â¬Ãƒâ€¦Ã‚Â¡ÃƒÆ’Ã†â€™ÃƒÂ¢Ã¢â€šÂ¬Ã…Â¡ÃƒÆ’Ã¢â‚¬Å¡Ãƒâ€šÃ‚Â¬ÃƒÆ’Ã†â€™Ãƒâ€ Ã¢â‚¬â„¢ÃƒÆ’Ã¢â‚¬Â ÃƒÂ¢Ã¢â€šÂ¬Ã¢â€žÂ¢ÃƒÆ’Ã†â€™ÃƒÂ¢Ã¢â€šÂ¬Ã‚Â ÃƒÆ’Ã‚Â¢ÃƒÂ¢Ã¢â‚¬Å¡Ã‚Â¬ÃƒÂ¢Ã¢â‚¬Å¾Ã‚Â¢ÃƒÆ’Ã†â€™Ãƒâ€ Ã¢â‚¬â„¢ÃƒÆ’Ã‚Â¢ÃƒÂ¢Ã¢â‚¬Å¡Ã‚Â¬Ãƒâ€šÃ‚Â ÃƒÆ’Ã†â€™Ãƒâ€šÃ‚Â¢ÃƒÆ’Ã‚Â¢ÃƒÂ¢Ã¢â€šÂ¬Ã…Â¡Ãƒâ€šÃ‚Â¬ÃƒÆ’Ã‚Â¢ÃƒÂ¢Ã¢â€šÂ¬Ã…Â¾Ãƒâ€šÃ‚Â¢ÃƒÆ’Ã†â€™Ãƒâ€ Ã¢â‚¬â„¢ÃƒÆ’Ã¢â‚¬Â ÃƒÂ¢Ã¢â€šÂ¬Ã¢â€žÂ¢ÃƒÆ’Ã†â€™Ãƒâ€šÃ‚Â¢ÃƒÆ’Ã‚Â¢ÃƒÂ¢Ã¢â€šÂ¬Ã…Â¡Ãƒâ€šÃ‚Â¬ÃƒÆ’Ã¢â‚¬Å¡Ãƒâ€šÃ‚Â ÃƒÆ’Ã†â€™Ãƒâ€ Ã¢â‚¬â„¢ÃƒÆ’Ã¢â‚¬Å¡Ãƒâ€šÃ‚Â¢ÃƒÆ’Ã†â€™Ãƒâ€šÃ‚Â¢ÃƒÆ’Ã‚Â¢ÃƒÂ¢Ã¢â‚¬Å¡Ã‚Â¬Ãƒâ€¦Ã‚Â¡ÃƒÆ’Ã¢â‚¬Å¡Ãƒâ€šÃ‚Â¬ÃƒÆ’Ã†â€™Ãƒâ€šÃ‚Â¢ÃƒÆ’Ã‚Â¢ÃƒÂ¢Ã¢â‚¬Å¡Ã‚Â¬Ãƒâ€¦Ã‚Â¾ÃƒÆ’Ã¢â‚¬Å¡Ãƒâ€šÃ‚Â¢ÃƒÆ’Ã†â€™Ãƒâ€ Ã¢â‚¬â„¢ÃƒÆ’Ã¢â‚¬Â ÃƒÂ¢Ã¢â€šÂ¬Ã¢â€žÂ¢ÃƒÆ’Ã†â€™ÃƒÂ¢Ã¢â€šÂ¬Ã‚Â ÃƒÆ’Ã‚Â¢ÃƒÂ¢Ã¢â‚¬Å¡Ã‚Â¬ÃƒÂ¢Ã¢â‚¬Å¾Ã‚Â¢ÃƒÆ’Ã†â€™Ãƒâ€ Ã¢â‚¬â„¢ÃƒÆ’Ã¢â‚¬Å¡Ãƒâ€šÃ‚Â¢ÃƒÆ’Ã†â€™Ãƒâ€šÃ‚Â¢ÃƒÆ’Ã‚Â¢ÃƒÂ¢Ã¢â‚¬Å¡Ã‚Â¬Ãƒâ€¦Ã‚Â¡ÃƒÆ’Ã¢â‚¬Å¡Ãƒâ€šÃ‚Â¬ÃƒÆ’Ã†â€™ÃƒÂ¢Ã¢â€šÂ¬Ã‚Â¦ÃƒÆ’Ã¢â‚¬Å¡Ãƒâ€šÃ‚Â¡ÃƒÆ’Ã†â€™Ãƒâ€ Ã¢â‚¬â„¢ÃƒÆ’Ã¢â‚¬Â ÃƒÂ¢Ã¢â€šÂ¬Ã¢â€žÂ¢ÃƒÆ’Ã†â€™Ãƒâ€šÃ‚Â¢ÃƒÆ’Ã‚Â¢ÃƒÂ¢Ã¢â€šÂ¬Ã…Â¡Ãƒâ€šÃ‚Â¬ÃƒÆ’Ã¢â‚¬Â¦Ãƒâ€šÃ‚Â¡ÃƒÆ’Ã†â€™Ãƒâ€ Ã¢â‚¬â„¢ÃƒÆ’Ã‚Â¢ÃƒÂ¢Ã¢â‚¬Å¡Ã‚Â¬Ãƒâ€¦Ã‚Â¡ÃƒÆ’Ã†â€™ÃƒÂ¢Ã¢â€šÂ¬Ã…Â¡ÃƒÆ’Ã¢â‚¬Å¡Ãƒâ€šÃ‚Â¢ÃƒÆ’Ã†â€™Ãƒâ€ Ã¢â‚¬â„¢ÃƒÆ’Ã¢â‚¬Â ÃƒÂ¢Ã¢â€šÂ¬Ã¢â€žÂ¢ÃƒÆ’Ã†â€™ÃƒÂ¢Ã¢â€šÂ¬Ã‚Â ÃƒÆ’Ã‚Â¢ÃƒÂ¢Ã¢â‚¬Å¡Ã‚Â¬ÃƒÂ¢Ã¢â‚¬Å¾Ã‚Â¢ÃƒÆ’Ã†â€™Ãƒâ€ Ã¢â‚¬â„¢ÃƒÆ’Ã‚Â¢ÃƒÂ¢Ã¢â‚¬Å¡Ã‚Â¬Ãƒâ€šÃ‚Â ÃƒÆ’Ã†â€™Ãƒâ€šÃ‚Â¢ÃƒÆ’Ã‚Â¢ÃƒÂ¢Ã¢â€šÂ¬Ã…Â¡Ãƒâ€šÃ‚Â¬ÃƒÆ’Ã‚Â¢ÃƒÂ¢Ã¢â€šÂ¬Ã…Â¾Ãƒâ€šÃ‚Â¢ÃƒÆ’Ã†â€™Ãƒâ€ Ã¢â‚¬â„¢ÃƒÆ’Ã¢â‚¬Â ÃƒÂ¢Ã¢â€šÂ¬Ã¢â€žÂ¢ÃƒÆ’Ã†â€™Ãƒâ€šÃ‚Â¢ÃƒÆ’Ã‚Â¢ÃƒÂ¢Ã¢â€šÂ¬Ã…Â¡Ãƒâ€šÃ‚Â¬ÃƒÆ’Ã¢â‚¬Â¦Ãƒâ€šÃ‚Â¡ÃƒÆ’Ã†â€™Ãƒâ€ Ã¢â‚¬â„¢ÃƒÆ’Ã‚Â¢ÃƒÂ¢Ã¢â‚¬Å¡Ã‚Â¬Ãƒâ€¦Ã‚Â¡ÃƒÆ’Ã†â€™ÃƒÂ¢Ã¢â€šÂ¬Ã…Â¡ÃƒÆ’Ã¢â‚¬Å¡Ãƒâ€šÃ‚Â¢ÃƒÆ’Ã†â€™Ãƒâ€ Ã¢â‚¬â„¢ÃƒÆ’Ã¢â‚¬Â ÃƒÂ¢Ã¢â€šÂ¬Ã¢â€žÂ¢ÃƒÆ’Ã†â€™ÃƒÂ¢Ã¢â€šÂ¬Ã‚Â ÃƒÆ’Ã‚Â¢ÃƒÂ¢Ã¢â‚¬Å¡Ã‚Â¬ÃƒÂ¢Ã¢â‚¬Å¾Ã‚Â¢ÃƒÆ’Ã†â€™Ãƒâ€ Ã¢â‚¬â„¢ÃƒÆ’Ã‚Â¢ÃƒÂ¢Ã¢â‚¬Å¡Ã‚Â¬Ãƒâ€¦Ã‚Â¡ÃƒÆ’Ã†â€™ÃƒÂ¢Ã¢â€šÂ¬Ã…Â¡ÃƒÆ’Ã¢â‚¬Å¡Ãƒâ€šÃ‚Â¢ÃƒÆ’Ã†â€™Ãƒâ€ Ã¢â‚¬â„¢ÃƒÆ’Ã¢â‚¬Â ÃƒÂ¢Ã¢â€šÂ¬Ã¢â€žÂ¢ÃƒÆ’Ã†â€™ÃƒÂ¢Ã¢â€šÂ¬Ã…Â¡ÃƒÆ’Ã¢â‚¬Å¡Ãƒâ€šÃ‚Â¢ÃƒÆ’Ã†â€™Ãƒâ€ Ã¢â‚¬â„¢ÃƒÆ’Ã¢â‚¬Å¡Ãƒâ€šÃ‚Â¢ÃƒÆ’Ã†â€™Ãƒâ€šÃ‚Â¢ÃƒÆ’Ã‚Â¢ÃƒÂ¢Ã¢â‚¬Å¡Ã‚Â¬Ãƒâ€¦Ã‚Â¡ÃƒÆ’Ã¢â‚¬Å¡Ãƒâ€šÃ‚Â¬ÃƒÆ’Ã†â€™ÃƒÂ¢Ã¢â€šÂ¬Ã‚Â¦ÃƒÆ’Ã¢â‚¬Å¡Ãƒâ€šÃ‚Â¡ÃƒÆ’Ã†â€™Ãƒâ€ Ã¢â‚¬â„¢ÃƒÆ’Ã‚Â¢ÃƒÂ¢Ã¢â‚¬Å¡Ã‚Â¬Ãƒâ€¦Ã‚Â¡ÃƒÆ’Ã†â€™ÃƒÂ¢Ã¢â€šÂ¬Ã…Â¡ÃƒÆ’Ã¢â‚¬Å¡Ãƒâ€šÃ‚Â¬ÃƒÆ’Ã†â€™Ãƒâ€ Ã¢â‚¬â„¢ÃƒÆ’Ã¢â‚¬Â ÃƒÂ¢Ã¢â€šÂ¬Ã¢â€žÂ¢ÃƒÆ’Ã†â€™Ãƒâ€šÃ‚Â¢ÃƒÆ’Ã‚Â¢ÃƒÂ¢Ã¢â€šÂ¬Ã…Â¡Ãƒâ€šÃ‚Â¬ÃƒÆ’Ã¢â‚¬Å¡Ãƒâ€šÃ‚Â¦ÃƒÆ’Ã†â€™Ãƒâ€ Ã¢â‚¬â„¢ÃƒÆ’Ã‚Â¢ÃƒÂ¢Ã¢â‚¬Å¡Ã‚Â¬Ãƒâ€¦Ã‚Â¡ÃƒÆ’Ã†â€™ÃƒÂ¢Ã¢â€šÂ¬Ã…Â¡ÃƒÆ’Ã¢â‚¬Å¡Ãƒâ€šÃ‚Â¡ÃƒÆ’Ã†â€™Ãƒâ€ Ã¢â‚¬â„¢ÃƒÆ’Ã¢â‚¬Â ÃƒÂ¢Ã¢â€šÂ¬Ã¢â€žÂ¢ÃƒÆ’Ã†â€™ÃƒÂ¢Ã¢â€šÂ¬Ã‚Â ÃƒÆ’Ã‚Â¢ÃƒÂ¢Ã¢â‚¬Å¡Ã‚Â¬ÃƒÂ¢Ã¢â‚¬Å¾Ã‚Â¢ÃƒÆ’Ã†â€™Ãƒâ€ Ã¢â‚¬â„¢ÃƒÆ’Ã¢â‚¬Å¡Ãƒâ€šÃ‚Â¢ÃƒÆ’Ã†â€™Ãƒâ€šÃ‚Â¢ÃƒÆ’Ã‚Â¢ÃƒÂ¢Ã¢â‚¬Å¡Ã‚Â¬Ãƒâ€¦Ã‚Â¡ÃƒÆ’Ã¢â‚¬Å¡Ãƒâ€šÃ‚Â¬ÃƒÆ’Ã†â€™ÃƒÂ¢Ã¢â€šÂ¬Ã‚Â¦ÃƒÆ’Ã¢â‚¬Å¡Ãƒâ€šÃ‚Â¡ÃƒÆ’Ã†â€™Ãƒâ€ Ã¢â‚¬â„¢ÃƒÆ’Ã¢â‚¬Â ÃƒÂ¢Ã¢â€šÂ¬Ã¢â€žÂ¢ÃƒÆ’Ã†â€™Ãƒâ€šÃ‚Â¢ÃƒÆ’Ã‚Â¢ÃƒÂ¢Ã¢â€šÂ¬Ã…Â¡Ãƒâ€šÃ‚Â¬ÃƒÆ’Ã¢â‚¬Â¦Ãƒâ€šÃ‚Â¡ÃƒÆ’Ã†â€™Ãƒâ€ Ã¢â‚¬â„¢ÃƒÆ’Ã‚Â¢ÃƒÂ¢Ã¢â‚¬Å¡Ã‚Â¬Ãƒâ€¦Ã‚Â¡ÃƒÆ’Ã†â€™ÃƒÂ¢Ã¢â€šÂ¬Ã…Â¡ÃƒÆ’Ã¢â‚¬Å¡Ãƒâ€šÃ‚Â¬ÃƒÆ’Ã†â€™Ãƒâ€ Ã¢â‚¬â„¢ÃƒÆ’Ã¢â‚¬Â ÃƒÂ¢Ã¢â€šÂ¬Ã¢â€žÂ¢ÃƒÆ’Ã†â€™ÃƒÂ¢Ã¢â€šÂ¬Ã‚Â ÃƒÆ’Ã‚Â¢ÃƒÂ¢Ã¢â‚¬Å¡Ã‚Â¬ÃƒÂ¢Ã¢â‚¬Å¾Ã‚Â¢ÃƒÆ’Ã†â€™Ãƒâ€ Ã¢â‚¬â„¢ÃƒÆ’Ã‚Â¢ÃƒÂ¢Ã¢â‚¬Å¡Ã‚Â¬Ãƒâ€šÃ‚Â ÃƒÆ’Ã†â€™Ãƒâ€šÃ‚Â¢ÃƒÆ’Ã‚Â¢ÃƒÂ¢Ã¢â€šÂ¬Ã…Â¡Ãƒâ€šÃ‚Â¬ÃƒÆ’Ã‚Â¢ÃƒÂ¢Ã¢â€šÂ¬Ã…Â¾Ãƒâ€šÃ‚Â¢ÃƒÆ’Ã†â€™Ãƒâ€ Ã¢â‚¬â„¢ÃƒÆ’Ã¢â‚¬Â ÃƒÂ¢Ã¢â€šÂ¬Ã¢â€žÂ¢ÃƒÆ’Ã†â€™ÃƒÂ¢Ã¢â€šÂ¬Ã…Â¡ÃƒÆ’Ã¢â‚¬Å¡Ãƒâ€šÃ‚Â¢ÃƒÆ’Ã†â€™Ãƒâ€ Ã¢â‚¬â„¢ÃƒÆ’Ã¢â‚¬Å¡Ãƒâ€šÃ‚Â¢ÃƒÆ’Ã†â€™Ãƒâ€šÃ‚Â¢ÃƒÆ’Ã‚Â¢ÃƒÂ¢Ã¢â€šÂ¬Ã…Â¡Ãƒâ€šÃ‚Â¬ÃƒÆ’Ã¢â‚¬Â¦Ãƒâ€šÃ‚Â¡ÃƒÆ’Ã†â€™ÃƒÂ¢Ã¢â€šÂ¬Ã…Â¡ÃƒÆ’Ã¢â‚¬Å¡Ãƒâ€šÃ‚Â¬ÃƒÆ’Ã†â€™Ãƒâ€ Ã¢â‚¬â„¢ÃƒÆ’Ã‚Â¢ÃƒÂ¢Ã¢â‚¬Å¡Ã‚Â¬Ãƒâ€¦Ã‚Â¡ÃƒÆ’Ã†â€™ÃƒÂ¢Ã¢â€šÂ¬Ã…Â¡ÃƒÆ’Ã¢â‚¬Å¡Ãƒâ€šÃ‚Â¦ÃƒÆ’Ã†â€™Ãƒâ€ Ã¢â‚¬â„¢ÃƒÆ’Ã¢â‚¬Â ÃƒÂ¢Ã¢â€šÂ¬Ã¢â€žÂ¢ÃƒÆ’Ã†â€™ÃƒÂ¢Ã¢â€šÂ¬Ã‚Â ÃƒÆ’Ã‚Â¢ÃƒÂ¢Ã¢â‚¬Å¡Ã‚Â¬ÃƒÂ¢Ã¢â‚¬Å¾Ã‚Â¢ÃƒÆ’Ã†â€™Ãƒâ€ Ã¢â‚¬â„¢ÃƒÆ’Ã‚Â¢ÃƒÂ¢Ã¢â‚¬Å¡Ã‚Â¬Ãƒâ€¦Ã‚Â¡ÃƒÆ’Ã†â€™ÃƒÂ¢Ã¢â€šÂ¬Ã…Â¡ÃƒÆ’Ã¢â‚¬Å¡Ãƒâ€šÃ‚Â¢ÃƒÆ’Ã†â€™Ãƒâ€ Ã¢â‚¬â„¢ÃƒÆ’Ã¢â‚¬Â ÃƒÂ¢Ã¢â€šÂ¬Ã¢â€žÂ¢ÃƒÆ’Ã†â€™ÃƒÂ¢Ã¢â€šÂ¬Ã…Â¡ÃƒÆ’Ã¢â‚¬Å¡Ãƒâ€šÃ‚Â¢ÃƒÆ’Ã†â€™Ãƒâ€ Ã¢â‚¬â„¢ÃƒÆ’Ã¢â‚¬Å¡Ãƒâ€šÃ‚Â¢ÃƒÆ’Ã†â€™Ãƒâ€šÃ‚Â¢ÃƒÆ’Ã‚Â¢ÃƒÂ¢Ã¢â‚¬Å¡Ã‚Â¬Ãƒâ€¦Ã‚Â¡ÃƒÆ’Ã¢â‚¬Å¡Ãƒâ€šÃ‚Â¬ÃƒÆ’Ã†â€™ÃƒÂ¢Ã¢â€šÂ¬Ã‚Â¦ÃƒÆ’Ã¢â‚¬Å¡Ãƒâ€šÃ‚Â¡ÃƒÆ’Ã†â€™Ãƒâ€ Ã¢â‚¬â„¢ÃƒÆ’Ã‚Â¢ÃƒÂ¢Ã¢â‚¬Å¡Ã‚Â¬Ãƒâ€¦Ã‚Â¡ÃƒÆ’Ã†â€™ÃƒÂ¢Ã¢â€šÂ¬Ã…Â¡ÃƒÆ’Ã¢â‚¬Å¡Ãƒâ€šÃ‚Â¬ÃƒÆ’Ã†â€™Ãƒâ€ Ã¢â‚¬â„¢ÃƒÆ’Ã¢â‚¬Â ÃƒÂ¢Ã¢â€šÂ¬Ã¢â€žÂ¢ÃƒÆ’Ã†â€™Ãƒâ€šÃ‚Â¢ÃƒÆ’Ã‚Â¢ÃƒÂ¢Ã¢â€šÂ¬Ã…Â¡Ãƒâ€šÃ‚Â¬ÃƒÆ’Ã¢â‚¬Å¡Ãƒâ€šÃ‚Â¦ÃƒÆ’Ã†â€™Ãƒâ€ Ã¢â‚¬â„¢ÃƒÆ’Ã¢â‚¬Å¡Ãƒâ€šÃ‚Â¢ÃƒÆ’Ã†â€™Ãƒâ€šÃ‚Â¢ÃƒÆ’Ã‚Â¢ÃƒÂ¢Ã¢â‚¬Å¡Ã‚Â¬Ãƒâ€¦Ã‚Â¡ÃƒÆ’Ã¢â‚¬Å¡Ãƒâ€šÃ‚Â¬ÃƒÆ’Ã†â€™ÃƒÂ¢Ã¢â€šÂ¬Ã‚Â¦ÃƒÆ’Ã‚Â¢ÃƒÂ¢Ã¢â‚¬Å¡Ã‚Â¬Ãƒâ€¦Ã¢â‚¬Å“Wk6), both systems recovered, with Monoculture reaching a higher peak growth rate (4.872%/day) compared to IMTA (2.246%/day). Overall, although Monoculture showed higher peak SGR values, the IMTA system demonstrated more stable and consistent </w:t>
       </w:r>
       <w:r>
         <w:rPr>
@@ -5421,7 +5421,7 @@
         <w:rPr>
           <w:rFonts w:ascii="Times New Roman" w:hAnsi="Times New Roman" w:cs="Times New Roman"/>
         </w:rPr>
-        <w:t xml:space="preserve"> across three experimental replicates. Overall, the statistical analysis shows no significant difference in weight gain between the replicates, as indicated by the One-Way ANOVA result (p = 0.5416), which is well above the 0.05 significance level. This is further supported by the ÃƒÆ’Ã†â€™Ãƒâ€ Ã¢â‚¬â„¢ÃƒÆ’Ã¢â‚¬Â ÃƒÂ¢Ã¢â€šÂ¬Ã¢â€žÂ¢ÃƒÆ’Ã†â€™ÃƒÂ¢Ã¢â€šÂ¬Ã‚Â ÃƒÆ’Ã‚Â¢ÃƒÂ¢Ã¢â‚¬Å¡Ã‚Â¬ÃƒÂ¢Ã¢â‚¬Å¾Ã‚Â¢ÃƒÆ’Ã†â€™Ãƒâ€ Ã¢â‚¬â„¢ÃƒÆ’Ã‚Â¢ÃƒÂ¢Ã¢â‚¬Å¡Ã‚Â¬Ãƒâ€šÃ‚Â ÃƒÆ’Ã†â€™Ãƒâ€šÃ‚Â¢ÃƒÆ’Ã‚Â¢ÃƒÂ¢Ã¢â€šÂ¬Ã…Â¡Ãƒâ€šÃ‚Â¬ÃƒÆ’Ã‚Â¢ÃƒÂ¢Ã¢â€šÂ¬Ã…Â¾Ãƒâ€šÃ‚Â¢ÃƒÆ’Ã†â€™Ãƒâ€ Ã¢â‚¬â„¢ÃƒÆ’Ã¢â‚¬Â ÃƒÂ¢Ã¢â€šÂ¬Ã¢â€žÂ¢ÃƒÆ’Ã†â€™Ãƒâ€šÃ‚Â¢ÃƒÆ’Ã‚Â¢ÃƒÂ¢Ã¢â€šÂ¬Ã…Â¡Ãƒâ€šÃ‚Â¬ÃƒÆ’Ã¢â‚¬Å¡Ãƒâ€šÃ‚Â ÃƒÆ’Ã†â€™Ãƒâ€ Ã¢â‚¬â„¢ÃƒÆ’Ã¢â‚¬Å¡Ãƒâ€šÃ‚Â¢ÃƒÆ’Ã†â€™Ãƒâ€šÃ‚Â¢ÃƒÆ’Ã‚Â¢ÃƒÂ¢Ã¢â‚¬Å¡Ã‚Â¬Ãƒâ€¦Ã‚Â¡ÃƒÆ’Ã¢â‚¬Å¡Ãƒâ€šÃ‚Â¬ÃƒÆ’Ã†â€™Ãƒâ€šÃ‚Â¢ÃƒÆ’Ã‚Â¢ÃƒÂ¢Ã¢â‚¬Å¡Ã‚Â¬Ãƒâ€¦Ã‚Â¾ÃƒÆ’Ã¢â‚¬Å¡Ãƒâ€šÃ‚Â¢ÃƒÆ’Ã†â€™Ãƒâ€ Ã¢â‚¬â„¢ÃƒÆ’Ã¢â‚¬Â ÃƒÂ¢Ã¢â€šÂ¬Ã¢â€žÂ¢ÃƒÆ’Ã†â€™ÃƒÂ¢Ã¢â€šÂ¬Ã‚Â ÃƒÆ’Ã‚Â¢ÃƒÂ¢Ã¢â‚¬Å¡Ã‚Â¬ÃƒÂ¢Ã¢â‚¬Å¾Ã‚Â¢ÃƒÆ’Ã†â€™Ãƒâ€ Ã¢â‚¬â„¢ÃƒÆ’Ã¢â‚¬Å¡Ãƒâ€šÃ‚Â¢ÃƒÆ’Ã†â€™Ãƒâ€šÃ‚Â¢ÃƒÆ’Ã‚Â¢ÃƒÂ¢Ã¢â‚¬Å¡Ã‚Â¬Ãƒâ€¦Ã‚Â¡ÃƒÆ’Ã¢â‚¬Å¡Ãƒâ€šÃ‚Â¬ÃƒÆ’Ã†â€™ÃƒÂ¢Ã¢â€šÂ¬Ã‚Â¦ÃƒÆ’Ã¢â‚¬Å¡Ãƒâ€šÃ‚Â¡ÃƒÆ’Ã†â€™Ãƒâ€ Ã¢â‚¬â„¢ÃƒÆ’Ã¢â‚¬Â ÃƒÂ¢Ã¢â€šÂ¬Ã¢â€žÂ¢ÃƒÆ’Ã†â€™Ãƒâ€šÃ‚Â¢ÃƒÆ’Ã‚Â¢ÃƒÂ¢Ã¢â€šÂ¬Ã…Â¡Ãƒâ€šÃ‚Â¬ÃƒÆ’Ã¢â‚¬Â¦Ãƒâ€šÃ‚Â¡ÃƒÆ’Ã†â€™Ãƒâ€ Ã¢â‚¬â„¢ÃƒÆ’Ã‚Â¢ÃƒÂ¢Ã¢â‚¬Å¡Ã‚Â¬Ãƒâ€¦Ã‚Â¡ÃƒÆ’Ã†â€™ÃƒÂ¢Ã¢â€šÂ¬Ã…Â¡ÃƒÆ’Ã¢â‚¬Å¡Ãƒâ€šÃ‚Â¢ÃƒÆ’Ã†â€™Ãƒâ€ Ã¢â‚¬â„¢ÃƒÆ’Ã¢â‚¬Â ÃƒÂ¢Ã¢â€šÂ¬Ã¢â€žÂ¢ÃƒÆ’Ã†â€™ÃƒÂ¢Ã¢â€šÂ¬Ã‚Â ÃƒÆ’Ã‚Â¢ÃƒÂ¢Ã¢â‚¬Å¡Ã‚Â¬ÃƒÂ¢Ã¢â‚¬Å¾Ã‚Â¢ÃƒÆ’Ã†â€™Ãƒâ€ Ã¢â‚¬â„¢ÃƒÆ’Ã‚Â¢ÃƒÂ¢Ã¢â‚¬Å¡Ã‚Â¬Ãƒâ€šÃ‚Â ÃƒÆ’Ã†â€™Ãƒâ€šÃ‚Â¢ÃƒÆ’Ã‚Â¢ÃƒÂ¢Ã¢â€šÂ¬Ã…Â¡Ãƒâ€šÃ‚Â¬ÃƒÆ’Ã‚Â¢ÃƒÂ¢Ã¢â€šÂ¬Ã…Â¾Ãƒâ€šÃ‚Â¢ÃƒÆ’Ã†â€™Ãƒâ€ Ã¢â‚¬â„¢ÃƒÆ’Ã¢â‚¬Â ÃƒÂ¢Ã¢â€šÂ¬Ã¢â€žÂ¢ÃƒÆ’Ã†â€™Ãƒâ€šÃ‚Â¢ÃƒÆ’Ã‚Â¢ÃƒÂ¢Ã¢â€šÂ¬Ã…Â¡Ãƒâ€šÃ‚Â¬ÃƒÆ’Ã¢â‚¬Â¦Ãƒâ€šÃ‚Â¡ÃƒÆ’Ã†â€™Ãƒâ€ Ã¢â‚¬â„¢ÃƒÆ’Ã‚Â¢ÃƒÂ¢Ã¢â‚¬Å¡Ã‚Â¬Ãƒâ€¦Ã‚Â¡ÃƒÆ’Ã†â€™ÃƒÂ¢Ã¢â€šÂ¬Ã…Â¡ÃƒÆ’Ã¢â‚¬Å¡Ãƒâ€šÃ‚Â¢ÃƒÆ’Ã†â€™Ãƒâ€ Ã¢â‚¬â„¢ÃƒÆ’Ã¢â‚¬Â ÃƒÂ¢Ã¢â€šÂ¬Ã¢â€žÂ¢ÃƒÆ’Ã†â€™ÃƒÂ¢Ã¢â€šÂ¬Ã‚Â ÃƒÆ’Ã‚Â¢ÃƒÂ¢Ã¢â‚¬Å¡Ã‚Â¬ÃƒÂ¢Ã¢â‚¬Å¾Ã‚Â¢ÃƒÆ’Ã†â€™Ãƒâ€ Ã¢â‚¬â„¢ÃƒÆ’Ã‚Â¢ÃƒÂ¢Ã¢â‚¬Å¡Ã‚Â¬Ãƒâ€¦Ã‚Â¡ÃƒÆ’Ã†â€™ÃƒÂ¢Ã¢â€šÂ¬Ã…Â¡ÃƒÆ’Ã¢â‚¬Å¡Ãƒâ€šÃ‚Â¢ÃƒÆ’Ã†â€™Ãƒâ€ Ã¢â‚¬â„¢ÃƒÆ’Ã¢â‚¬Â ÃƒÂ¢Ã¢â€šÂ¬Ã¢â€žÂ¢ÃƒÆ’Ã†â€™ÃƒÂ¢Ã¢â€šÂ¬Ã…Â¡ÃƒÆ’Ã¢â‚¬Å¡Ãƒâ€šÃ‚Â¢ÃƒÆ’Ã†â€™Ãƒâ€ Ã¢â‚¬â„¢ÃƒÆ’Ã¢â‚¬Å¡Ãƒâ€šÃ‚Â¢ÃƒÆ’Ã†â€™Ãƒâ€šÃ‚Â¢ÃƒÆ’Ã‚Â¢ÃƒÂ¢Ã¢â‚¬Å¡Ã‚Â¬Ãƒâ€¦Ã‚Â¡ÃƒÆ’Ã¢â‚¬Å¡Ãƒâ€šÃ‚Â¬ÃƒÆ’Ã†â€™ÃƒÂ¢Ã¢â€šÂ¬Ã‚Â¦ÃƒÆ’Ã¢â‚¬Å¡Ãƒâ€šÃ‚Â¡ÃƒÆ’Ã†â€™Ãƒâ€ Ã¢â‚¬â„¢ÃƒÆ’Ã‚Â¢ÃƒÂ¢Ã¢â‚¬Å¡Ã‚Â¬Ãƒâ€¦Ã‚Â¡ÃƒÆ’Ã†â€™ÃƒÂ¢Ã¢â€šÂ¬Ã…Â¡ÃƒÆ’Ã¢â‚¬Å¡Ãƒâ€šÃ‚Â¬ÃƒÆ’Ã†â€™Ãƒâ€ Ã¢â‚¬â„¢ÃƒÆ’Ã¢â‚¬Â ÃƒÂ¢Ã¢â€šÂ¬Ã¢â€žÂ¢ÃƒÆ’Ã†â€™Ãƒâ€šÃ‚Â¢ÃƒÆ’Ã‚Â¢ÃƒÂ¢Ã¢â€šÂ¬Ã…Â¡Ãƒâ€šÃ‚Â¬ÃƒÆ’Ã¢â‚¬Å¡Ãƒâ€šÃ‚Â¦ÃƒÆ’Ã†â€™Ãƒâ€ Ã¢â‚¬â„¢ÃƒÆ’Ã‚Â¢ÃƒÂ¢Ã¢â‚¬Å¡Ã‚Â¬Ãƒâ€¦Ã‚Â¡ÃƒÆ’Ã†â€™ÃƒÂ¢Ã¢â€šÂ¬Ã…Â¡ÃƒÆ’Ã¢â‚¬Å¡Ãƒâ€šÃ‚Â¡ÃƒÆ’Ã†â€™Ãƒâ€ Ã¢â‚¬â„¢ÃƒÆ’Ã¢â‚¬Â ÃƒÂ¢Ã¢â€šÂ¬Ã¢â€žÂ¢ÃƒÆ’Ã†â€™ÃƒÂ¢Ã¢â€šÂ¬Ã‚Â ÃƒÆ’Ã‚Â¢ÃƒÂ¢Ã¢â‚¬Å¡Ã‚Â¬ÃƒÂ¢Ã¢â‚¬Å¾Ã‚Â¢ÃƒÆ’Ã†â€™Ãƒâ€ Ã¢â‚¬â„¢ÃƒÆ’Ã¢â‚¬Å¡Ãƒâ€šÃ‚Â¢ÃƒÆ’Ã†â€™Ãƒâ€šÃ‚Â¢ÃƒÆ’Ã‚Â¢ÃƒÂ¢Ã¢â‚¬Å¡Ã‚Â¬Ãƒâ€¦Ã‚Â¡ÃƒÆ’Ã¢â‚¬Å¡Ãƒâ€šÃ‚Â¬ÃƒÆ’Ã†â€™ÃƒÂ¢Ã¢â€šÂ¬Ã‚Â¦ÃƒÆ’Ã¢â‚¬Å¡Ãƒâ€šÃ‚Â¡ÃƒÆ’Ã†â€™Ãƒâ€ Ã¢â‚¬â„¢ÃƒÆ’Ã¢â‚¬Â ÃƒÂ¢Ã¢â€šÂ¬Ã¢â€žÂ¢ÃƒÆ’Ã†â€™Ãƒâ€šÃ‚Â¢ÃƒÆ’Ã‚Â¢ÃƒÂ¢Ã¢â€šÂ¬Ã…Â¡Ãƒâ€šÃ‚Â¬ÃƒÆ’Ã¢â‚¬Â¦Ãƒâ€šÃ‚Â¡ÃƒÆ’Ã†â€™Ãƒâ€ Ã¢â‚¬â„¢ÃƒÆ’Ã‚Â¢ÃƒÂ¢Ã¢â‚¬Å¡Ã‚Â¬Ãƒâ€¦Ã‚Â¡ÃƒÆ’Ã†â€™ÃƒÂ¢Ã¢â€šÂ¬Ã…Â¡ÃƒÆ’Ã¢â‚¬Å¡Ãƒâ€šÃ‚Â¬ÃƒÆ’Ã†â€™Ãƒâ€ Ã¢â‚¬â„¢ÃƒÆ’Ã¢â‚¬Â ÃƒÂ¢Ã¢â€šÂ¬Ã¢â€žÂ¢ÃƒÆ’Ã†â€™ÃƒÂ¢Ã¢â€šÂ¬Ã‚Â ÃƒÆ’Ã‚Â¢ÃƒÂ¢Ã¢â‚¬Å¡Ã‚Â¬ÃƒÂ¢Ã¢â‚¬Å¾Ã‚Â¢ÃƒÆ’Ã†â€™Ãƒâ€ Ã¢â‚¬â„¢ÃƒÆ’Ã‚Â¢ÃƒÂ¢Ã¢â‚¬Å¡Ã‚Â¬Ãƒâ€šÃ‚Â ÃƒÆ’Ã†â€™Ãƒâ€šÃ‚Â¢ÃƒÆ’Ã‚Â¢ÃƒÂ¢Ã¢â€šÂ¬Ã…Â¡Ãƒâ€šÃ‚Â¬ÃƒÆ’Ã‚Â¢ÃƒÂ¢Ã¢â€šÂ¬Ã…Â¾Ãƒâ€šÃ‚Â¢ÃƒÆ’Ã†â€™Ãƒâ€ Ã¢â‚¬â„¢ÃƒÆ’Ã¢â‚¬Â ÃƒÂ¢Ã¢â€šÂ¬Ã¢â€žÂ¢ÃƒÆ’Ã†â€™ÃƒÂ¢Ã¢â€šÂ¬Ã…Â¡ÃƒÆ’Ã¢â‚¬Å¡Ãƒâ€šÃ‚Â¢ÃƒÆ’Ã†â€™Ãƒâ€ Ã¢â‚¬â„¢ÃƒÆ’Ã¢â‚¬Å¡Ãƒâ€šÃ‚Â¢ÃƒÆ’Ã†â€™Ãƒâ€šÃ‚Â¢ÃƒÆ’Ã‚Â¢ÃƒÂ¢Ã¢â€šÂ¬Ã…Â¡Ãƒâ€šÃ‚Â¬ÃƒÆ’Ã¢â‚¬Â¦Ãƒâ€šÃ‚Â¡ÃƒÆ’Ã†â€™ÃƒÂ¢Ã¢â€šÂ¬Ã…Â¡ÃƒÆ’Ã¢â‚¬Å¡Ãƒâ€šÃ‚Â¬ÃƒÆ’Ã†â€™Ãƒâ€ Ã¢â‚¬â„¢ÃƒÆ’Ã‚Â¢ÃƒÂ¢Ã¢â‚¬Å¡Ã‚Â¬Ãƒâ€¦Ã‚Â¡ÃƒÆ’Ã†â€™ÃƒÂ¢Ã¢â€šÂ¬Ã…Â¡ÃƒÆ’Ã¢â‚¬Å¡Ãƒâ€šÃ‚Â¦ÃƒÆ’Ã†â€™Ãƒâ€ Ã¢â‚¬â„¢ÃƒÆ’Ã¢â‚¬Â ÃƒÂ¢Ã¢â€šÂ¬Ã¢â€žÂ¢ÃƒÆ’Ã†â€™ÃƒÂ¢Ã¢â€šÂ¬Ã‚Â ÃƒÆ’Ã‚Â¢ÃƒÂ¢Ã¢â‚¬Å¡Ã‚Â¬ÃƒÂ¢Ã¢â‚¬Å¾Ã‚Â¢ÃƒÆ’Ã†â€™Ãƒâ€ Ã¢â‚¬â„¢ÃƒÆ’Ã‚Â¢ÃƒÂ¢Ã¢â‚¬Å¡Ã‚Â¬Ãƒâ€¦Ã‚Â¡ÃƒÆ’Ã†â€™ÃƒÂ¢Ã¢â€šÂ¬Ã…Â¡ÃƒÆ’Ã¢â‚¬Å¡Ãƒâ€šÃ‚Â¢ÃƒÆ’Ã†â€™Ãƒâ€ Ã¢â‚¬â„¢ÃƒÆ’Ã¢â‚¬Â ÃƒÂ¢Ã¢â€šÂ¬Ã¢â€žÂ¢ÃƒÆ’Ã†â€™ÃƒÂ¢Ã¢â€šÂ¬Ã…Â¡ÃƒÆ’Ã¢â‚¬Å¡Ãƒâ€šÃ‚Â¢ÃƒÆ’Ã†â€™Ãƒâ€ Ã¢â‚¬â„¢ÃƒÆ’Ã¢â‚¬Å¡Ãƒâ€šÃ‚Â¢ÃƒÆ’Ã†â€™Ãƒâ€šÃ‚Â¢ÃƒÆ’Ã‚Â¢ÃƒÂ¢Ã¢â‚¬Å¡Ã‚Â¬Ãƒâ€¦Ã‚Â¡ÃƒÆ’Ã¢â‚¬Å¡Ãƒâ€šÃ‚Â¬ÃƒÆ’Ã†â€™ÃƒÂ¢Ã¢â€šÂ¬Ã‚Â¦ÃƒÆ’Ã¢â‚¬Å¡Ãƒâ€šÃ‚Â¡ÃƒÆ’Ã†â€™Ãƒâ€ Ã¢â‚¬â„¢ÃƒÆ’Ã‚Â¢ÃƒÂ¢Ã¢â‚¬Å¡Ã‚Â¬Ãƒâ€¦Ã‚Â¡ÃƒÆ’Ã†â€™ÃƒÂ¢Ã¢â€šÂ¬Ã…Â¡ÃƒÆ’Ã¢â‚¬Å¡Ãƒâ€šÃ‚Â¬ÃƒÆ’Ã†â€™Ãƒâ€ Ã¢â‚¬â„¢ÃƒÆ’Ã¢â‚¬Â ÃƒÂ¢Ã¢â€šÂ¬Ã¢â€žÂ¢ÃƒÆ’Ã†â€™Ãƒâ€šÃ‚Â¢ÃƒÆ’Ã‚Â¢ÃƒÂ¢Ã¢â€šÂ¬Ã…Â¡Ãƒâ€šÃ‚Â¬ÃƒÆ’Ã¢â‚¬Å¡Ãƒâ€šÃ‚Â¦ÃƒÆ’Ã†â€™Ãƒâ€ Ã¢â‚¬â„¢ÃƒÆ’Ã¢â‚¬Å¡Ãƒâ€šÃ‚Â¢ÃƒÆ’Ã†â€™Ãƒâ€šÃ‚Â¢ÃƒÆ’Ã‚Â¢ÃƒÂ¢Ã¢â‚¬Å¡Ã‚Â¬Ãƒâ€¦Ã‚Â¡ÃƒÆ’Ã¢â‚¬Å¡Ãƒâ€šÃ‚Â¬ÃƒÆ’Ã†â€™ÃƒÂ¢Ã¢â€šÂ¬Ã‚Â¦ÃƒÆ’Ã‚Â¢ÃƒÂ¢Ã¢â‚¬Å¡Ã‚Â¬Ãƒâ€¦Ã¢â‚¬Å“nsÃƒÆ’Ã†â€™Ãƒâ€ Ã¢â‚¬â„¢ÃƒÆ’Ã¢â‚¬Â ÃƒÂ¢Ã¢â€šÂ¬Ã¢â€žÂ¢ÃƒÆ’Ã†â€™ÃƒÂ¢Ã¢â€šÂ¬Ã‚Â ÃƒÆ’Ã‚Â¢ÃƒÂ¢Ã¢â‚¬Å¡Ã‚Â¬ÃƒÂ¢Ã¢â‚¬Å¾Ã‚Â¢ÃƒÆ’Ã†â€™Ãƒâ€ Ã¢â‚¬â„¢ÃƒÆ’Ã‚Â¢ÃƒÂ¢Ã¢â‚¬Å¡Ã‚Â¬Ãƒâ€šÃ‚Â ÃƒÆ’Ã†â€™Ãƒâ€šÃ‚Â¢ÃƒÆ’Ã‚Â¢ÃƒÂ¢Ã¢â€šÂ¬Ã…Â¡Ãƒâ€šÃ‚Â¬ÃƒÆ’Ã‚Â¢ÃƒÂ¢Ã¢â€šÂ¬Ã…Â¾Ãƒâ€šÃ‚Â¢ÃƒÆ’Ã†â€™Ãƒâ€ Ã¢â‚¬â„¢ÃƒÆ’Ã¢â‚¬Â ÃƒÂ¢Ã¢â€šÂ¬Ã¢â€žÂ¢ÃƒÆ’Ã†â€™Ãƒâ€šÃ‚Â¢ÃƒÆ’Ã‚Â¢ÃƒÂ¢Ã¢â€šÂ¬Ã…Â¡Ãƒâ€šÃ‚Â¬ÃƒÆ’Ã¢â‚¬Å¡Ãƒâ€šÃ‚Â ÃƒÆ’Ã†â€™Ãƒâ€ Ã¢â‚¬â„¢ÃƒÆ’Ã¢â‚¬Å¡Ãƒâ€šÃ‚Â¢ÃƒÆ’Ã†â€™Ãƒâ€šÃ‚Â¢ÃƒÆ’Ã‚Â¢ÃƒÂ¢Ã¢â‚¬Å¡Ã‚Â¬Ãƒâ€¦Ã‚Â¡ÃƒÆ’Ã¢â‚¬Å¡Ãƒâ€šÃ‚Â¬ÃƒÆ’Ã†â€™Ãƒâ€šÃ‚Â¢ÃƒÆ’Ã‚Â¢ÃƒÂ¢Ã¢â‚¬Å¡Ã‚Â¬Ãƒâ€¦Ã‚Â¾ÃƒÆ’Ã¢â‚¬Å¡Ãƒâ€šÃ‚Â¢ÃƒÆ’Ã†â€™Ãƒâ€ Ã¢â‚¬â„¢ÃƒÆ’Ã¢â‚¬Â ÃƒÂ¢Ã¢â€šÂ¬Ã¢â€žÂ¢ÃƒÆ’Ã†â€™ÃƒÂ¢Ã¢â€šÂ¬Ã‚Â ÃƒÆ’Ã‚Â¢ÃƒÂ¢Ã¢â‚¬Å¡Ã‚Â¬ÃƒÂ¢Ã¢â‚¬Å¾Ã‚Â¢ÃƒÆ’Ã†â€™Ãƒâ€ Ã¢â‚¬â„¢ÃƒÆ’Ã¢â‚¬Å¡Ãƒâ€šÃ‚Â¢ÃƒÆ’Ã†â€™Ãƒâ€šÃ‚Â¢ÃƒÆ’Ã‚Â¢ÃƒÂ¢Ã¢â‚¬Å¡Ã‚Â¬Ãƒâ€¦Ã‚Â¡ÃƒÆ’Ã¢â‚¬Å¡Ãƒâ€šÃ‚Â¬ÃƒÆ’Ã†â€™ÃƒÂ¢Ã¢â€šÂ¬Ã‚Â¦ÃƒÆ’Ã¢â‚¬Å¡Ãƒâ€šÃ‚Â¡ÃƒÆ’Ã†â€™Ãƒâ€ Ã¢â‚¬â„¢ÃƒÆ’Ã¢â‚¬Â ÃƒÂ¢Ã¢â€šÂ¬Ã¢â€žÂ¢ÃƒÆ’Ã†â€™Ãƒâ€šÃ‚Â¢ÃƒÆ’Ã‚Â¢ÃƒÂ¢Ã¢â€šÂ¬Ã…Â¡Ãƒâ€šÃ‚Â¬ÃƒÆ’Ã¢â‚¬Â¦Ãƒâ€šÃ‚Â¡ÃƒÆ’Ã†â€™Ãƒâ€ Ã¢â‚¬â„¢ÃƒÆ’Ã‚Â¢ÃƒÂ¢Ã¢â‚¬Å¡Ã‚Â¬Ãƒâ€¦Ã‚Â¡ÃƒÆ’Ã†â€™ÃƒÂ¢Ã¢â€šÂ¬Ã…Â¡ÃƒÆ’Ã¢â‚¬Å¡Ãƒâ€šÃ‚Â¢ÃƒÆ’Ã†â€™Ãƒâ€ Ã¢â‚¬â„¢ÃƒÆ’Ã¢â‚¬Â ÃƒÂ¢Ã¢â€šÂ¬Ã¢â€žÂ¢ÃƒÆ’Ã†â€™ÃƒÂ¢Ã¢â€šÂ¬Ã‚Â ÃƒÆ’Ã‚Â¢ÃƒÂ¢Ã¢â‚¬Å¡Ã‚Â¬ÃƒÂ¢Ã¢â‚¬Å¾Ã‚Â¢ÃƒÆ’Ã†â€™Ãƒâ€ Ã¢â‚¬â„¢ÃƒÆ’Ã‚Â¢ÃƒÂ¢Ã¢â‚¬Å¡Ã‚Â¬Ãƒâ€šÃ‚Â ÃƒÆ’Ã†â€™Ãƒâ€šÃ‚Â¢ÃƒÆ’Ã‚Â¢ÃƒÂ¢Ã¢â€šÂ¬Ã…Â¡Ãƒâ€šÃ‚Â¬ÃƒÆ’Ã‚Â¢ÃƒÂ¢Ã¢â€šÂ¬Ã…Â¾Ãƒâ€šÃ‚Â¢ÃƒÆ’Ã†â€™Ãƒâ€ Ã¢â‚¬â„¢ÃƒÆ’Ã¢â‚¬Â ÃƒÂ¢Ã¢â€šÂ¬Ã¢â€žÂ¢ÃƒÆ’Ã†â€™Ãƒâ€šÃ‚Â¢ÃƒÆ’Ã‚Â¢ÃƒÂ¢Ã¢â€šÂ¬Ã…Â¡Ãƒâ€šÃ‚Â¬ÃƒÆ’Ã¢â‚¬Â¦Ãƒâ€šÃ‚Â¡ÃƒÆ’Ã†â€™Ãƒâ€ Ã¢â‚¬â„¢ÃƒÆ’Ã‚Â¢ÃƒÂ¢Ã¢â‚¬Å¡Ã‚Â¬Ãƒâ€¦Ã‚Â¡ÃƒÆ’Ã†â€™ÃƒÂ¢Ã¢â€šÂ¬Ã…Â¡ÃƒÆ’Ã¢â‚¬Å¡Ãƒâ€šÃ‚Â¢ÃƒÆ’Ã†â€™Ãƒâ€ Ã¢â‚¬â„¢ÃƒÆ’Ã¢â‚¬Â ÃƒÂ¢Ã¢â€šÂ¬Ã¢â€žÂ¢ÃƒÆ’Ã†â€™ÃƒÂ¢Ã¢â€šÂ¬Ã‚Â ÃƒÆ’Ã‚Â¢ÃƒÂ¢Ã¢â‚¬Å¡Ã‚Â¬ÃƒÂ¢Ã¢â‚¬Å¾Ã‚Â¢ÃƒÆ’Ã†â€™Ãƒâ€ Ã¢â‚¬â„¢ÃƒÆ’Ã‚Â¢ÃƒÂ¢Ã¢â‚¬Å¡Ã‚Â¬Ãƒâ€¦Ã‚Â¡ÃƒÆ’Ã†â€™ÃƒÂ¢Ã¢â€šÂ¬Ã…Â¡ÃƒÆ’Ã¢â‚¬Å¡Ãƒâ€šÃ‚Â¢ÃƒÆ’Ã†â€™Ãƒâ€ Ã¢â‚¬â„¢ÃƒÆ’Ã¢â‚¬Â ÃƒÂ¢Ã¢â€šÂ¬Ã¢â€žÂ¢ÃƒÆ’Ã†â€™ÃƒÂ¢Ã¢â€šÂ¬Ã…Â¡ÃƒÆ’Ã¢â‚¬Å¡Ãƒâ€šÃ‚Â¢ÃƒÆ’Ã†â€™Ãƒâ€ Ã¢â‚¬â„¢ÃƒÆ’Ã¢â‚¬Å¡Ãƒâ€šÃ‚Â¢ÃƒÆ’Ã†â€™Ãƒâ€šÃ‚Â¢ÃƒÆ’Ã‚Â¢ÃƒÂ¢Ã¢â‚¬Å¡Ã‚Â¬Ãƒâ€¦Ã‚Â¡ÃƒÆ’Ã¢â‚¬Å¡Ãƒâ€šÃ‚Â¬ÃƒÆ’Ã†â€™ÃƒÂ¢Ã¢â€šÂ¬Ã‚Â¦ÃƒÆ’Ã¢â‚¬Å¡Ãƒâ€šÃ‚Â¡ÃƒÆ’Ã†â€™Ãƒâ€ Ã¢â‚¬â„¢ÃƒÆ’Ã‚Â¢ÃƒÂ¢Ã¢â‚¬Å¡Ã‚Â¬Ãƒâ€¦Ã‚Â¡ÃƒÆ’Ã†â€™ÃƒÂ¢Ã¢â€šÂ¬Ã…Â¡ÃƒÆ’Ã¢â‚¬Å¡Ãƒâ€šÃ‚Â¬ÃƒÆ’Ã†â€™Ãƒâ€ Ã¢â‚¬â„¢ÃƒÆ’Ã¢â‚¬Â ÃƒÂ¢Ã¢â€šÂ¬Ã¢â€žÂ¢ÃƒÆ’Ã†â€™Ãƒâ€šÃ‚Â¢ÃƒÆ’Ã‚Â¢ÃƒÂ¢Ã¢â€šÂ¬Ã…Â¡Ãƒâ€šÃ‚Â¬ÃƒÆ’Ã¢â‚¬Å¡Ãƒâ€šÃ‚Â¦ÃƒÆ’Ã†â€™Ãƒâ€ Ã¢â‚¬â„¢ÃƒÆ’Ã‚Â¢ÃƒÂ¢Ã¢â‚¬Å¡Ã‚Â¬Ãƒâ€¦Ã‚Â¡ÃƒÆ’Ã†â€™ÃƒÂ¢Ã¢â€šÂ¬Ã…Â¡ÃƒÆ’Ã¢â‚¬Å¡Ãƒâ€šÃ‚Â¡ÃƒÆ’Ã†â€™Ãƒâ€ Ã¢â‚¬â„¢ÃƒÆ’Ã¢â‚¬Â ÃƒÂ¢Ã¢â€šÂ¬Ã¢â€žÂ¢ÃƒÆ’Ã†â€™ÃƒÂ¢Ã¢â€šÂ¬Ã‚Â ÃƒÆ’Ã‚Â¢ÃƒÂ¢Ã¢â‚¬Å¡Ã‚Â¬ÃƒÂ¢Ã¢â‚¬Å¾Ã‚Â¢ÃƒÆ’Ã†â€™Ãƒâ€ Ã¢â‚¬â„¢ÃƒÆ’Ã¢â‚¬Å¡Ãƒâ€šÃ‚Â¢ÃƒÆ’Ã†â€™Ãƒâ€šÃ‚Â¢ÃƒÆ’Ã‚Â¢ÃƒÂ¢Ã¢â‚¬Å¡Ã‚Â¬Ãƒâ€¦Ã‚Â¡ÃƒÆ’Ã¢â‚¬Å¡Ãƒâ€šÃ‚Â¬ÃƒÆ’Ã†â€™ÃƒÂ¢Ã¢â€šÂ¬Ã‚Â¦ÃƒÆ’Ã¢â‚¬Å¡Ãƒâ€šÃ‚Â¡ÃƒÆ’Ã†â€™Ãƒâ€ Ã¢â‚¬â„¢ÃƒÆ’Ã¢â‚¬Â ÃƒÂ¢Ã¢â€šÂ¬Ã¢â€žÂ¢ÃƒÆ’Ã†â€™Ãƒâ€šÃ‚Â¢ÃƒÆ’Ã‚Â¢ÃƒÂ¢Ã¢â€šÂ¬Ã…Â¡Ãƒâ€šÃ‚Â¬ÃƒÆ’Ã¢â‚¬Â¦Ãƒâ€šÃ‚Â¡ÃƒÆ’Ã†â€™Ãƒâ€ Ã¢â‚¬â„¢ÃƒÆ’Ã‚Â¢ÃƒÂ¢Ã¢â‚¬Å¡Ã‚Â¬Ãƒâ€¦Ã‚Â¡ÃƒÆ’Ã†â€™ÃƒÂ¢Ã¢â€šÂ¬Ã…Â¡ÃƒÆ’Ã¢â‚¬Å¡Ãƒâ€šÃ‚Â¬ÃƒÆ’Ã†â€™Ãƒâ€ Ã¢â‚¬â„¢ÃƒÆ’Ã¢â‚¬Â ÃƒÂ¢Ã¢â€šÂ¬Ã¢â€žÂ¢ÃƒÆ’Ã†â€™ÃƒÂ¢Ã¢â€šÂ¬Ã‚Â ÃƒÆ’Ã‚Â¢ÃƒÂ¢Ã¢â‚¬Å¡Ã‚Â¬ÃƒÂ¢Ã¢â‚¬Å¾Ã‚Â¢ÃƒÆ’Ã†â€™Ãƒâ€ Ã¢â‚¬â„¢ÃƒÆ’Ã‚Â¢ÃƒÂ¢Ã¢â‚¬Å¡Ã‚Â¬Ãƒâ€šÃ‚Â ÃƒÆ’Ã†â€™Ãƒâ€šÃ‚Â¢ÃƒÆ’Ã‚Â¢ÃƒÂ¢Ã¢â€šÂ¬Ã…Â¡Ãƒâ€šÃ‚Â¬ÃƒÆ’Ã‚Â¢ÃƒÂ¢Ã¢â€šÂ¬Ã…Â¾Ãƒâ€šÃ‚Â¢ÃƒÆ’Ã†â€™Ãƒâ€ Ã¢â‚¬â„¢ÃƒÆ’Ã¢â‚¬Â ÃƒÂ¢Ã¢â€šÂ¬Ã¢â€žÂ¢ÃƒÆ’Ã†â€™ÃƒÂ¢Ã¢â€šÂ¬Ã…Â¡ÃƒÆ’Ã¢â‚¬Å¡Ãƒâ€šÃ‚Â¢ÃƒÆ’Ã†â€™Ãƒâ€ Ã¢â‚¬â„¢ÃƒÆ’Ã¢â‚¬Å¡Ãƒâ€šÃ‚Â¢ÃƒÆ’Ã†â€™Ãƒâ€šÃ‚Â¢ÃƒÆ’Ã‚Â¢ÃƒÂ¢Ã¢â€šÂ¬Ã…Â¡Ãƒâ€šÃ‚Â¬ÃƒÆ’Ã¢â‚¬Â¦Ãƒâ€šÃ‚Â¡ÃƒÆ’Ã†â€™ÃƒÂ¢Ã¢â€šÂ¬Ã…Â¡ÃƒÆ’Ã¢â‚¬Å¡Ãƒâ€šÃ‚Â¬ÃƒÆ’Ã†â€™Ãƒâ€ Ã¢â‚¬â„¢ÃƒÆ’Ã‚Â¢ÃƒÂ¢Ã¢â‚¬Å¡Ã‚Â¬Ãƒâ€šÃ‚Â¦ÃƒÆ’Ã†â€™ÃƒÂ¢Ã¢â€šÂ¬Ã…Â¡ÃƒÆ’Ã¢â‚¬Å¡Ãƒâ€šÃ‚Â¡ÃƒÆ’Ã†â€™Ãƒâ€ Ã¢â‚¬â„¢ÃƒÆ’Ã¢â‚¬Â ÃƒÂ¢Ã¢â€šÂ¬Ã¢â€žÂ¢ÃƒÆ’Ã†â€™ÃƒÂ¢Ã¢â€šÂ¬Ã‚Â ÃƒÆ’Ã‚Â¢ÃƒÂ¢Ã¢â‚¬Å¡Ã‚Â¬ÃƒÂ¢Ã¢â‚¬Å¾Ã‚Â¢ÃƒÆ’Ã†â€™Ãƒâ€ Ã¢â‚¬â„¢ÃƒÆ’Ã¢â‚¬Å¡Ãƒâ€šÃ‚Â¢ÃƒÆ’Ã†â€™Ãƒâ€šÃ‚Â¢ÃƒÆ’Ã‚Â¢ÃƒÂ¢Ã¢â‚¬Å¡Ã‚Â¬Ãƒâ€¦Ã‚Â¡ÃƒÆ’Ã¢â‚¬Å¡Ãƒâ€šÃ‚Â¬ÃƒÆ’Ã†â€™ÃƒÂ¢Ã¢â€šÂ¬Ã‚Â¦ÃƒÆ’Ã¢â‚¬Å¡Ãƒâ€šÃ‚Â¡ÃƒÆ’Ã†â€™Ãƒâ€ Ã¢â‚¬â„¢ÃƒÆ’Ã¢â‚¬Â ÃƒÂ¢Ã¢â€šÂ¬Ã¢â€žÂ¢ÃƒÆ’Ã†â€™Ãƒâ€šÃ‚Â¢ÃƒÆ’Ã‚Â¢ÃƒÂ¢Ã¢â€šÂ¬Ã…Â¡Ãƒâ€šÃ‚Â¬ÃƒÆ’Ã¢â‚¬Â¦Ãƒâ€šÃ‚Â¡ÃƒÆ’Ã†â€™Ãƒâ€ Ã¢â‚¬â„¢ÃƒÆ’Ã‚Â¢ÃƒÂ¢Ã¢â‚¬Å¡Ã‚Â¬Ãƒâ€¦Ã‚Â¡ÃƒÆ’Ã†â€™ÃƒÂ¢Ã¢â€šÂ¬Ã…Â¡ÃƒÆ’Ã¢â‚¬Å¡Ãƒâ€šÃ‚Â (non-significant) labels in the pairwise comparisons, confirming that none of the replicates differed meaningfully from each other.</w:t>
+        <w:t xml:space="preserve"> across three experimental replicates. Overall, the statistical analysis shows no significant difference in weight gain between the replicates, as indicated by the One-Way ANOVA result (p = 0.5416), which is well above the 0.05 significance level. This is further supported by the ÃƒÆ’Ã†â€™Ãƒâ€ Ã¢â‚¬â„¢ÃƒÆ’Ã¢â‚¬Â ÃƒÂ¢Ã¢â€šÂ¬Ã¢â€žÂ¢ÃƒÆ’Ã†â€™ÃƒÂ¢Ã¢â€šÂ¬Ã‚Â ÃƒÆ’Ã‚Â¢ÃƒÂ¢Ã¢â‚¬Å¡Ã‚Â¬ÃƒÂ¢Ã¢â‚¬Å¾Ã‚Â¢ÃƒÆ’Ã†â€™Ãƒâ€ Ã¢â‚¬â„¢ÃƒÆ’Ã‚Â¢ÃƒÂ¢Ã¢â‚¬Å¡Ã‚Â¬Ãƒâ€šÃ‚Â ÃƒÆ’Ã†â€™Ãƒâ€šÃ‚Â¢ÃƒÆ’Ã‚Â¢ÃƒÂ¢Ã¢â€šÂ¬Ã…Â¡Ãƒâ€šÃ‚Â¬ÃƒÆ’Ã‚Â¢ÃƒÂ¢Ã¢â€šÂ¬Ã…Â¾Ãƒâ€šÃ‚Â¢ÃƒÆ’Ã†â€™Ãƒâ€ Ã¢â‚¬â„¢ÃƒÆ’Ã¢â‚¬Â ÃƒÂ¢Ã¢â€šÂ¬Ã¢â€žÂ¢ÃƒÆ’Ã†â€™Ãƒâ€šÃ‚Â¢ÃƒÆ’Ã‚Â¢ÃƒÂ¢Ã¢â€šÂ¬Ã…Â¡Ãƒâ€šÃ‚Â¬ÃƒÆ’Ã¢â‚¬Å¡Ãƒâ€šÃ‚Â ÃƒÆ’Ã†â€™Ãƒâ€ Ã¢â‚¬â„¢ÃƒÆ’Ã¢â‚¬Å¡Ãƒâ€šÃ‚Â¢ÃƒÆ’Ã†â€™Ãƒâ€šÃ‚Â¢ÃƒÆ’Ã‚Â¢ÃƒÂ¢Ã¢â‚¬Å¡Ã‚Â¬Ãƒâ€¦Ã‚Â¡ÃƒÆ’Ã¢â‚¬Å¡Ãƒâ€šÃ‚Â¬ÃƒÆ’Ã†â€™Ãƒâ€šÃ‚Â¢ÃƒÆ’Ã‚Â¢ÃƒÂ¢Ã¢â‚¬Å¡Ã‚Â¬Ãƒâ€¦Ã‚Â¾ÃƒÆ’Ã¢â‚¬Å¡Ãƒâ€šÃ‚Â¢ÃƒÆ’Ã†â€™Ãƒâ€ Ã¢â‚¬â„¢ÃƒÆ’Ã¢â‚¬Â ÃƒÂ¢Ã¢â€šÂ¬Ã¢â€žÂ¢ÃƒÆ’Ã†â€™ÃƒÂ¢Ã¢â€šÂ¬Ã‚Â ÃƒÆ’Ã‚Â¢ÃƒÂ¢Ã¢â‚¬Å¡Ã‚Â¬ÃƒÂ¢Ã¢â‚¬Å¾Ã‚Â¢ÃƒÆ’Ã†â€™Ãƒâ€ Ã¢â‚¬â„¢ÃƒÆ’Ã¢â‚¬Å¡Ãƒâ€šÃ‚Â¢ÃƒÆ’Ã†â€™Ãƒâ€šÃ‚Â¢ÃƒÆ’Ã‚Â¢ÃƒÂ¢Ã¢â‚¬Å¡Ã‚Â¬Ãƒâ€¦Ã‚Â¡ÃƒÆ’Ã¢â‚¬Å¡Ãƒâ€šÃ‚Â¬ÃƒÆ’Ã†â€™ÃƒÂ¢Ã¢â€šÂ¬Ã…Â¡ÃƒÆ’Ã¢â‚¬Å¡Ãƒâ€šÃ‚Â ÃƒÆ’Ã†â€™Ãƒâ€ Ã¢â‚¬â„¢ÃƒÆ’Ã¢â‚¬Â ÃƒÂ¢Ã¢â€šÂ¬Ã¢â€žÂ¢ÃƒÆ’Ã†â€™ÃƒÂ¢Ã¢â€šÂ¬Ã…Â¡ÃƒÆ’Ã¢â‚¬Å¡Ãƒâ€šÃ‚Â¢ÃƒÆ’Ã†â€™Ãƒâ€ Ã¢â‚¬â„¢ÃƒÆ’Ã¢â‚¬Å¡Ãƒâ€šÃ‚Â¢ÃƒÆ’Ã†â€™Ãƒâ€šÃ‚Â¢ÃƒÆ’Ã‚Â¢ÃƒÂ¢Ã¢â€šÂ¬Ã…Â¡Ãƒâ€šÃ‚Â¬ÃƒÆ’Ã¢â‚¬Â¦Ãƒâ€šÃ‚Â¡ÃƒÆ’Ã†â€™ÃƒÂ¢Ã¢â€šÂ¬Ã…Â¡ÃƒÆ’Ã¢â‚¬Å¡Ãƒâ€šÃ‚Â¬ÃƒÆ’Ã†â€™Ãƒâ€ Ã¢â‚¬â„¢ÃƒÆ’Ã¢â‚¬Å¡Ãƒâ€šÃ‚Â¢ÃƒÆ’Ã†â€™Ãƒâ€šÃ‚Â¢ÃƒÆ’Ã‚Â¢ÃƒÂ¢Ã¢â€šÂ¬Ã…Â¡Ãƒâ€šÃ‚Â¬ÃƒÆ’Ã¢â‚¬Â¦Ãƒâ€šÃ‚Â¾ÃƒÆ’Ã†â€™ÃƒÂ¢Ã¢â€šÂ¬Ã…Â¡ÃƒÆ’Ã¢â‚¬Å¡Ãƒâ€šÃ‚Â¢ÃƒÆ’Ã†â€™Ãƒâ€ Ã¢â‚¬â„¢ÃƒÆ’Ã¢â‚¬Â ÃƒÂ¢Ã¢â€šÂ¬Ã¢â€žÂ¢ÃƒÆ’Ã†â€™ÃƒÂ¢Ã¢â€šÂ¬Ã‚Â ÃƒÆ’Ã‚Â¢ÃƒÂ¢Ã¢â‚¬Å¡Ã‚Â¬ÃƒÂ¢Ã¢â‚¬Å¾Ã‚Â¢ÃƒÆ’Ã†â€™Ãƒâ€ Ã¢â‚¬â„¢ÃƒÆ’Ã‚Â¢ÃƒÂ¢Ã¢â‚¬Å¡Ã‚Â¬Ãƒâ€šÃ‚Â ÃƒÆ’Ã†â€™Ãƒâ€šÃ‚Â¢ÃƒÆ’Ã‚Â¢ÃƒÂ¢Ã¢â€šÂ¬Ã…Â¡Ãƒâ€šÃ‚Â¬ÃƒÆ’Ã‚Â¢ÃƒÂ¢Ã¢â€šÂ¬Ã…Â¾Ãƒâ€šÃ‚Â¢ÃƒÆ’Ã†â€™Ãƒâ€ Ã¢â‚¬â„¢ÃƒÆ’Ã¢â‚¬Â ÃƒÂ¢Ã¢â€šÂ¬Ã¢â€žÂ¢ÃƒÆ’Ã†â€™ÃƒÂ¢Ã¢â€šÂ¬Ã…Â¡ÃƒÆ’Ã¢â‚¬Å¡Ãƒâ€šÃ‚Â¢ÃƒÆ’Ã†â€™Ãƒâ€ Ã¢â‚¬â„¢ÃƒÆ’Ã¢â‚¬Å¡Ãƒâ€šÃ‚Â¢ÃƒÆ’Ã†â€™Ãƒâ€šÃ‚Â¢ÃƒÆ’Ã‚Â¢ÃƒÂ¢Ã¢â€šÂ¬Ã…Â¡Ãƒâ€šÃ‚Â¬ÃƒÆ’Ã¢â‚¬Â¦Ãƒâ€šÃ‚Â¡ÃƒÆ’Ã†â€™ÃƒÂ¢Ã¢â€šÂ¬Ã…Â¡ÃƒÆ’Ã¢â‚¬Å¡Ãƒâ€šÃ‚Â¬ÃƒÆ’Ã†â€™Ãƒâ€ Ã¢â‚¬â„¢ÃƒÆ’Ã‚Â¢ÃƒÂ¢Ã¢â‚¬Å¡Ã‚Â¬Ãƒâ€šÃ‚Â¦ÃƒÆ’Ã†â€™ÃƒÂ¢Ã¢â€šÂ¬Ã…Â¡ÃƒÆ’Ã¢â‚¬Å¡Ãƒâ€šÃ‚Â¡ÃƒÆ’Ã†â€™Ãƒâ€ Ã¢â‚¬â„¢ÃƒÆ’Ã¢â‚¬Â ÃƒÂ¢Ã¢â€šÂ¬Ã¢â€žÂ¢ÃƒÆ’Ã†â€™ÃƒÂ¢Ã¢â€šÂ¬Ã‚Â ÃƒÆ’Ã‚Â¢ÃƒÂ¢Ã¢â‚¬Å¡Ã‚Â¬ÃƒÂ¢Ã¢â‚¬Å¾Ã‚Â¢ÃƒÆ’Ã†â€™Ãƒâ€ Ã¢â‚¬â„¢ÃƒÆ’Ã¢â‚¬Å¡Ãƒâ€šÃ‚Â¢ÃƒÆ’Ã†â€™Ãƒâ€šÃ‚Â¢ÃƒÆ’Ã‚Â¢ÃƒÂ¢Ã¢â‚¬Å¡Ã‚Â¬Ãƒâ€¦Ã‚Â¡ÃƒÆ’Ã¢â‚¬Å¡Ãƒâ€šÃ‚Â¬ÃƒÆ’Ã†â€™ÃƒÂ¢Ã¢â€šÂ¬Ã‚Â¦ÃƒÆ’Ã¢â‚¬Å¡Ãƒâ€šÃ‚Â¡ÃƒÆ’Ã†â€™Ãƒâ€ Ã¢â‚¬â„¢ÃƒÆ’Ã¢â‚¬Â ÃƒÂ¢Ã¢â€šÂ¬Ã¢â€žÂ¢ÃƒÆ’Ã†â€™Ãƒâ€šÃ‚Â¢ÃƒÆ’Ã‚Â¢ÃƒÂ¢Ã¢â€šÂ¬Ã…Â¡Ãƒâ€šÃ‚Â¬ÃƒÆ’Ã¢â‚¬Â¦Ãƒâ€šÃ‚Â¡ÃƒÆ’Ã†â€™Ãƒâ€ Ã¢â‚¬â„¢ÃƒÆ’Ã‚Â¢ÃƒÂ¢Ã¢â‚¬Å¡Ã‚Â¬Ãƒâ€¦Ã‚Â¡ÃƒÆ’Ã†â€™ÃƒÂ¢Ã¢â€šÂ¬Ã…Â¡ÃƒÆ’Ã¢â‚¬Å¡Ãƒâ€šÃ‚Â¢ÃƒÆ’Ã†â€™Ãƒâ€ Ã¢â‚¬â„¢ÃƒÆ’Ã¢â‚¬Â ÃƒÂ¢Ã¢â€šÂ¬Ã¢â€žÂ¢ÃƒÆ’Ã†â€™ÃƒÂ¢Ã¢â€šÂ¬Ã‚Â ÃƒÆ’Ã‚Â¢ÃƒÂ¢Ã¢â‚¬Å¡Ã‚Â¬ÃƒÂ¢Ã¢â‚¬Å¾Ã‚Â¢ÃƒÆ’Ã†â€™Ãƒâ€ Ã¢â‚¬â„¢ÃƒÆ’Ã‚Â¢ÃƒÂ¢Ã¢â‚¬Å¡Ã‚Â¬Ãƒâ€šÃ‚Â ÃƒÆ’Ã†â€™Ãƒâ€šÃ‚Â¢ÃƒÆ’Ã‚Â¢ÃƒÂ¢Ã¢â€šÂ¬Ã…Â¡Ãƒâ€šÃ‚Â¬ÃƒÆ’Ã‚Â¢ÃƒÂ¢Ã¢â€šÂ¬Ã…Â¾Ãƒâ€šÃ‚Â¢ÃƒÆ’Ã†â€™Ãƒâ€ Ã¢â‚¬â„¢ÃƒÆ’Ã¢â‚¬Â ÃƒÂ¢Ã¢â€šÂ¬Ã¢â€žÂ¢ÃƒÆ’Ã†â€™Ãƒâ€šÃ‚Â¢ÃƒÆ’Ã‚Â¢ÃƒÂ¢Ã¢â€šÂ¬Ã…Â¡Ãƒâ€šÃ‚Â¬ÃƒÆ’Ã¢â‚¬Å¡Ãƒâ€šÃ‚Â ÃƒÆ’Ã†â€™Ãƒâ€ Ã¢â‚¬â„¢ÃƒÆ’Ã¢â‚¬Å¡Ãƒâ€šÃ‚Â¢ÃƒÆ’Ã†â€™Ãƒâ€šÃ‚Â¢ÃƒÆ’Ã‚Â¢ÃƒÂ¢Ã¢â‚¬Å¡Ã‚Â¬Ãƒâ€¦Ã‚Â¡ÃƒÆ’Ã¢â‚¬Å¡Ãƒâ€šÃ‚Â¬ÃƒÆ’Ã†â€™Ãƒâ€šÃ‚Â¢ÃƒÆ’Ã‚Â¢ÃƒÂ¢Ã¢â‚¬Å¡Ã‚Â¬Ãƒâ€¦Ã‚Â¾ÃƒÆ’Ã¢â‚¬Å¡Ãƒâ€šÃ‚Â¢ÃƒÆ’Ã†â€™Ãƒâ€ Ã¢â‚¬â„¢ÃƒÆ’Ã¢â‚¬Â ÃƒÂ¢Ã¢â€šÂ¬Ã¢â€žÂ¢ÃƒÆ’Ã†â€™ÃƒÂ¢Ã¢â€šÂ¬Ã‚Â ÃƒÆ’Ã‚Â¢ÃƒÂ¢Ã¢â‚¬Å¡Ã‚Â¬ÃƒÂ¢Ã¢â‚¬Å¾Ã‚Â¢ÃƒÆ’Ã†â€™Ãƒâ€ Ã¢â‚¬â„¢ÃƒÆ’Ã¢â‚¬Å¡Ãƒâ€šÃ‚Â¢ÃƒÆ’Ã†â€™Ãƒâ€šÃ‚Â¢ÃƒÆ’Ã‚Â¢ÃƒÂ¢Ã¢â‚¬Å¡Ã‚Â¬Ãƒâ€¦Ã‚Â¡ÃƒÆ’Ã¢â‚¬Å¡Ãƒâ€šÃ‚Â¬ÃƒÆ’Ã†â€™ÃƒÂ¢Ã¢â€šÂ¬Ã‚Â¦ÃƒÆ’Ã¢â‚¬Å¡Ãƒâ€šÃ‚Â¡ÃƒÆ’Ã†â€™Ãƒâ€ Ã¢â‚¬â„¢ÃƒÆ’Ã¢â‚¬Â ÃƒÂ¢Ã¢â€šÂ¬Ã¢â€žÂ¢ÃƒÆ’Ã†â€™Ãƒâ€šÃ‚Â¢ÃƒÆ’Ã‚Â¢ÃƒÂ¢Ã¢â€šÂ¬Ã…Â¡Ãƒâ€šÃ‚Â¬ÃƒÆ’Ã¢â‚¬Â¦Ãƒâ€šÃ‚Â¡ÃƒÆ’Ã†â€™Ãƒâ€ Ã¢â‚¬â„¢ÃƒÆ’Ã‚Â¢ÃƒÂ¢Ã¢â‚¬Å¡Ã‚Â¬Ãƒâ€¦Ã‚Â¡ÃƒÆ’Ã†â€™ÃƒÂ¢Ã¢â€šÂ¬Ã…Â¡ÃƒÆ’Ã¢â‚¬Å¡Ãƒâ€šÃ‚Â¢ÃƒÆ’Ã†â€™Ãƒâ€ Ã¢â‚¬â„¢ÃƒÆ’Ã¢â‚¬Â ÃƒÂ¢Ã¢â€šÂ¬Ã¢â€žÂ¢ÃƒÆ’Ã†â€™ÃƒÂ¢Ã¢â€šÂ¬Ã‚Â ÃƒÆ’Ã‚Â¢ÃƒÂ¢Ã¢â‚¬Å¡Ã‚Â¬ÃƒÂ¢Ã¢â‚¬Å¾Ã‚Â¢ÃƒÆ’Ã†â€™Ãƒâ€ Ã¢â‚¬â„¢ÃƒÆ’Ã‚Â¢ÃƒÂ¢Ã¢â‚¬Å¡Ã‚Â¬Ãƒâ€šÃ‚Â ÃƒÆ’Ã†â€™Ãƒâ€šÃ‚Â¢ÃƒÆ’Ã‚Â¢ÃƒÂ¢Ã¢â€šÂ¬Ã…Â¡Ãƒâ€šÃ‚Â¬ÃƒÆ’Ã‚Â¢ÃƒÂ¢Ã¢â€šÂ¬Ã…Â¾Ãƒâ€šÃ‚Â¢ÃƒÆ’Ã†â€™Ãƒâ€ Ã¢â‚¬â„¢ÃƒÆ’Ã¢â‚¬Â ÃƒÂ¢Ã¢â€šÂ¬Ã¢â€žÂ¢ÃƒÆ’Ã†â€™Ãƒâ€šÃ‚Â¢ÃƒÆ’Ã‚Â¢ÃƒÂ¢Ã¢â€šÂ¬Ã…Â¡Ãƒâ€šÃ‚Â¬ÃƒÆ’Ã¢â‚¬Â¦Ãƒâ€šÃ‚Â¡ÃƒÆ’Ã†â€™Ãƒâ€ Ã¢â‚¬â„¢ÃƒÆ’Ã‚Â¢ÃƒÂ¢Ã¢â‚¬Å¡Ã‚Â¬Ãƒâ€¦Ã‚Â¡ÃƒÆ’Ã†â€™ÃƒÂ¢Ã¢â€šÂ¬Ã…Â¡ÃƒÆ’Ã¢â‚¬Å¡Ãƒâ€šÃ‚Â¢ÃƒÆ’Ã†â€™Ãƒâ€ Ã¢â‚¬â„¢ÃƒÆ’Ã¢â‚¬Â ÃƒÂ¢Ã¢â€šÂ¬Ã¢â€žÂ¢ÃƒÆ’Ã†â€™ÃƒÂ¢Ã¢â€šÂ¬Ã‚Â ÃƒÆ’Ã‚Â¢ÃƒÂ¢Ã¢â‚¬Å¡Ã‚Â¬ÃƒÂ¢Ã¢â‚¬Å¾Ã‚Â¢ÃƒÆ’Ã†â€™Ãƒâ€ Ã¢â‚¬â„¢ÃƒÆ’Ã‚Â¢ÃƒÂ¢Ã¢â‚¬Å¡Ã‚Â¬Ãƒâ€¦Ã‚Â¡ÃƒÆ’Ã†â€™ÃƒÂ¢Ã¢â€šÂ¬Ã…Â¡ÃƒÆ’Ã¢â‚¬Å¡Ãƒâ€šÃ‚Â¢ÃƒÆ’Ã†â€™Ãƒâ€ Ã¢â‚¬â„¢ÃƒÆ’Ã¢â‚¬Â ÃƒÂ¢Ã¢â€šÂ¬Ã¢â€žÂ¢ÃƒÆ’Ã†â€™ÃƒÂ¢Ã¢â€šÂ¬Ã…Â¡ÃƒÆ’Ã¢â‚¬Å¡Ãƒâ€šÃ‚Â¢ÃƒÆ’Ã†â€™Ãƒâ€ Ã¢â‚¬â„¢ÃƒÆ’Ã¢â‚¬Å¡Ãƒâ€šÃ‚Â¢ÃƒÆ’Ã†â€™Ãƒâ€šÃ‚Â¢ÃƒÆ’Ã‚Â¢ÃƒÂ¢Ã¢â€šÂ¬Ã…Â¡Ãƒâ€šÃ‚Â¬ÃƒÆ’Ã¢â‚¬Â¦Ãƒâ€šÃ‚Â¡ÃƒÆ’Ã†â€™ÃƒÂ¢Ã¢â€šÂ¬Ã…Â¡ÃƒÆ’Ã¢â‚¬Å¡Ãƒâ€šÃ‚Â¬ÃƒÆ’Ã†â€™Ãƒâ€ Ã¢â‚¬â„¢ÃƒÆ’Ã‚Â¢ÃƒÂ¢Ã¢â‚¬Å¡Ã‚Â¬Ãƒâ€šÃ‚Â¦ÃƒÆ’Ã†â€™ÃƒÂ¢Ã¢â€šÂ¬Ã…Â¡ÃƒÆ’Ã¢â‚¬Å¡Ãƒâ€šÃ‚Â¡ÃƒÆ’Ã†â€™Ãƒâ€ Ã¢â‚¬â„¢ÃƒÆ’Ã¢â‚¬Â ÃƒÂ¢Ã¢â€šÂ¬Ã¢â€žÂ¢ÃƒÆ’Ã†â€™Ãƒâ€šÃ‚Â¢ÃƒÆ’Ã‚Â¢ÃƒÂ¢Ã¢â€šÂ¬Ã…Â¡Ãƒâ€šÃ‚Â¬ÃƒÆ’Ã¢â‚¬Â¦Ãƒâ€šÃ‚Â¡ÃƒÆ’Ã†â€™Ãƒâ€ Ã¢â‚¬â„¢ÃƒÆ’Ã‚Â¢ÃƒÂ¢Ã¢â‚¬Å¡Ã‚Â¬Ãƒâ€¦Ã‚Â¡ÃƒÆ’Ã†â€™ÃƒÂ¢Ã¢â€šÂ¬Ã…Â¡ÃƒÆ’Ã¢â‚¬Å¡Ãƒâ€šÃ‚Â¬ÃƒÆ’Ã†â€™Ãƒâ€ Ã¢â‚¬â„¢ÃƒÆ’Ã¢â‚¬Â ÃƒÂ¢Ã¢â€šÂ¬Ã¢â€žÂ¢ÃƒÆ’Ã†â€™ÃƒÂ¢Ã¢â€šÂ¬Ã‚Â ÃƒÆ’Ã‚Â¢ÃƒÂ¢Ã¢â‚¬Å¡Ã‚Â¬ÃƒÂ¢Ã¢â‚¬Å¾Ã‚Â¢ÃƒÆ’Ã†â€™Ãƒâ€ Ã¢â‚¬â„¢ÃƒÆ’Ã¢â‚¬Å¡Ãƒâ€šÃ‚Â¢ÃƒÆ’Ã†â€™Ãƒâ€šÃ‚Â¢ÃƒÆ’Ã‚Â¢ÃƒÂ¢Ã¢â‚¬Å¡Ã‚Â¬Ãƒâ€¦Ã‚Â¡ÃƒÆ’Ã¢â‚¬Å¡Ãƒâ€šÃ‚Â¬ÃƒÆ’Ã†â€™ÃƒÂ¢Ã¢â€šÂ¬Ã…Â¡ÃƒÆ’Ã¢â‚¬Å¡Ãƒâ€šÃ‚Â¦ÃƒÆ’Ã†â€™Ãƒâ€ Ã¢â‚¬â„¢ÃƒÆ’Ã¢â‚¬Â ÃƒÂ¢Ã¢â€šÂ¬Ã¢â€žÂ¢ÃƒÆ’Ã†â€™Ãƒâ€šÃ‚Â¢ÃƒÆ’Ã‚Â¢ÃƒÂ¢Ã¢â€šÂ¬Ã…Â¡Ãƒâ€šÃ‚Â¬ÃƒÆ’Ã¢â‚¬Â¦Ãƒâ€šÃ‚Â¡ÃƒÆ’Ã†â€™Ãƒâ€ Ã¢â‚¬â„¢ÃƒÆ’Ã‚Â¢ÃƒÂ¢Ã¢â‚¬Å¡Ã‚Â¬Ãƒâ€¦Ã‚Â¡ÃƒÆ’Ã†â€™ÃƒÂ¢Ã¢â€šÂ¬Ã…Â¡ÃƒÆ’Ã¢â‚¬Å¡Ãƒâ€šÃ‚Â¡ÃƒÆ’Ã†â€™Ãƒâ€ Ã¢â‚¬â„¢ÃƒÆ’Ã¢â‚¬Â ÃƒÂ¢Ã¢â€šÂ¬Ã¢â€žÂ¢ÃƒÆ’Ã†â€™ÃƒÂ¢Ã¢â€šÂ¬Ã‚Â ÃƒÆ’Ã‚Â¢ÃƒÂ¢Ã¢â‚¬Å¡Ã‚Â¬ÃƒÂ¢Ã¢â‚¬Å¾Ã‚Â¢ÃƒÆ’Ã†â€™Ãƒâ€ Ã¢â‚¬â„¢ÃƒÆ’Ã‚Â¢ÃƒÂ¢Ã¢â‚¬Å¡Ã‚Â¬Ãƒâ€šÃ‚Â ÃƒÆ’Ã†â€™Ãƒâ€šÃ‚Â¢ÃƒÆ’Ã‚Â¢ÃƒÂ¢Ã¢â€šÂ¬Ã…Â¡Ãƒâ€šÃ‚Â¬ÃƒÆ’Ã‚Â¢ÃƒÂ¢Ã¢â€šÂ¬Ã…Â¾Ãƒâ€šÃ‚Â¢ÃƒÆ’Ã†â€™Ãƒâ€ Ã¢â‚¬â„¢ÃƒÆ’Ã¢â‚¬Â ÃƒÂ¢Ã¢â€šÂ¬Ã¢â€žÂ¢ÃƒÆ’Ã†â€™ÃƒÂ¢Ã¢â€šÂ¬Ã…Â¡ÃƒÆ’Ã¢â‚¬Å¡Ãƒâ€šÃ‚Â¢ÃƒÆ’Ã†â€™Ãƒâ€ Ã¢â‚¬â„¢ÃƒÆ’Ã¢â‚¬Å¡Ãƒâ€šÃ‚Â¢ÃƒÆ’Ã†â€™Ãƒâ€šÃ‚Â¢ÃƒÆ’Ã‚Â¢ÃƒÂ¢Ã¢â€šÂ¬Ã…Â¡Ãƒâ€šÃ‚Â¬ÃƒÆ’Ã¢â‚¬Â¦Ãƒâ€šÃ‚Â¡ÃƒÆ’Ã†â€™ÃƒÂ¢Ã¢â€šÂ¬Ã…Â¡ÃƒÆ’Ã¢â‚¬Å¡Ãƒâ€šÃ‚Â¬ÃƒÆ’Ã†â€™Ãƒâ€ Ã¢â‚¬â„¢ÃƒÆ’Ã‚Â¢ÃƒÂ¢Ã¢â‚¬Å¡Ã‚Â¬Ãƒâ€šÃ‚Â¦ÃƒÆ’Ã†â€™ÃƒÂ¢Ã¢â€šÂ¬Ã…Â¡ÃƒÆ’Ã¢â‚¬Å¡Ãƒâ€šÃ‚Â¡ÃƒÆ’Ã†â€™Ãƒâ€ Ã¢â‚¬â„¢ÃƒÆ’Ã¢â‚¬Â ÃƒÂ¢Ã¢â€šÂ¬Ã¢â€žÂ¢ÃƒÆ’Ã†â€™ÃƒÂ¢Ã¢â€šÂ¬Ã‚Â ÃƒÆ’Ã‚Â¢ÃƒÂ¢Ã¢â‚¬Å¡Ã‚Â¬ÃƒÂ¢Ã¢â‚¬Å¾Ã‚Â¢ÃƒÆ’Ã†â€™Ãƒâ€ Ã¢â‚¬â„¢ÃƒÆ’Ã¢â‚¬Å¡Ãƒâ€šÃ‚Â¢ÃƒÆ’Ã†â€™Ãƒâ€šÃ‚Â¢ÃƒÆ’Ã‚Â¢ÃƒÂ¢Ã¢â‚¬Å¡Ã‚Â¬Ãƒâ€¦Ã‚Â¡ÃƒÆ’Ã¢â‚¬Å¡Ãƒâ€šÃ‚Â¬ÃƒÆ’Ã†â€™ÃƒÂ¢Ã¢â€šÂ¬Ã‚Â¦ÃƒÆ’Ã¢â‚¬Å¡Ãƒâ€šÃ‚Â¡ÃƒÆ’Ã†â€™Ãƒâ€ Ã¢â‚¬â„¢ÃƒÆ’Ã¢â‚¬Â ÃƒÂ¢Ã¢â€šÂ¬Ã¢â€žÂ¢ÃƒÆ’Ã†â€™Ãƒâ€šÃ‚Â¢ÃƒÆ’Ã‚Â¢ÃƒÂ¢Ã¢â€šÂ¬Ã…Â¡Ãƒâ€šÃ‚Â¬ÃƒÆ’Ã¢â‚¬Â¦Ãƒâ€šÃ‚Â¡ÃƒÆ’Ã†â€™Ãƒâ€ Ã¢â‚¬â„¢ÃƒÆ’Ã‚Â¢ÃƒÂ¢Ã¢â‚¬Å¡Ã‚Â¬Ãƒâ€¦Ã‚Â¡ÃƒÆ’Ã†â€™ÃƒÂ¢Ã¢â€šÂ¬Ã…Â¡ÃƒÆ’Ã¢â‚¬Å¡Ãƒâ€šÃ‚Â¬ÃƒÆ’Ã†â€™Ãƒâ€ Ã¢â‚¬â„¢ÃƒÆ’Ã¢â‚¬Â ÃƒÂ¢Ã¢â€šÂ¬Ã¢â€žÂ¢ÃƒÆ’Ã†â€™ÃƒÂ¢Ã¢â€šÂ¬Ã‚Â ÃƒÆ’Ã‚Â¢ÃƒÂ¢Ã¢â‚¬Å¡Ã‚Â¬ÃƒÂ¢Ã¢â‚¬Å¾Ã‚Â¢ÃƒÆ’Ã†â€™Ãƒâ€ Ã¢â‚¬â„¢ÃƒÆ’Ã‚Â¢ÃƒÂ¢Ã¢â‚¬Å¡Ã‚Â¬Ãƒâ€šÃ‚Â ÃƒÆ’Ã†â€™Ãƒâ€šÃ‚Â¢ÃƒÆ’Ã‚Â¢ÃƒÂ¢Ã¢â€šÂ¬Ã…Â¡Ãƒâ€šÃ‚Â¬ÃƒÆ’Ã‚Â¢ÃƒÂ¢Ã¢â€šÂ¬Ã…Â¾Ãƒâ€šÃ‚Â¢ÃƒÆ’Ã†â€™Ãƒâ€ Ã¢â‚¬â„¢ÃƒÆ’Ã¢â‚¬Â ÃƒÂ¢Ã¢â€šÂ¬Ã¢â€žÂ¢ÃƒÆ’Ã†â€™Ãƒâ€šÃ‚Â¢ÃƒÆ’Ã‚Â¢ÃƒÂ¢Ã¢â€šÂ¬Ã…Â¡Ãƒâ€šÃ‚Â¬ÃƒÆ’Ã¢â‚¬Å¡Ãƒâ€šÃ‚Â ÃƒÆ’Ã†â€™Ãƒâ€ Ã¢â‚¬â„¢ÃƒÆ’Ã¢â‚¬Å¡Ãƒâ€šÃ‚Â¢ÃƒÆ’Ã†â€™Ãƒâ€šÃ‚Â¢ÃƒÆ’Ã‚Â¢ÃƒÂ¢Ã¢â‚¬Å¡Ã‚Â¬Ãƒâ€¦Ã‚Â¡ÃƒÆ’Ã¢â‚¬Å¡Ãƒâ€šÃ‚Â¬ÃƒÆ’Ã†â€™Ãƒâ€šÃ‚Â¢ÃƒÆ’Ã‚Â¢ÃƒÂ¢Ã¢â‚¬Å¡Ã‚Â¬Ãƒâ€¦Ã‚Â¾ÃƒÆ’Ã¢â‚¬Å¡Ãƒâ€šÃ‚Â¢ÃƒÆ’Ã†â€™Ãƒâ€ Ã¢â‚¬â„¢ÃƒÆ’Ã¢â‚¬Â ÃƒÂ¢Ã¢â€šÂ¬Ã¢â€žÂ¢ÃƒÆ’Ã†â€™ÃƒÂ¢Ã¢â€šÂ¬Ã‚Â ÃƒÆ’Ã‚Â¢ÃƒÂ¢Ã¢â‚¬Å¡Ã‚Â¬ÃƒÂ¢Ã¢â‚¬Å¾Ã‚Â¢ÃƒÆ’Ã†â€™Ãƒâ€ Ã¢â‚¬â„¢ÃƒÆ’Ã‚Â¢ÃƒÂ¢Ã¢â‚¬Å¡Ã‚Â¬Ãƒâ€¦Ã‚Â¡ÃƒÆ’Ã†â€™ÃƒÂ¢Ã¢â€šÂ¬Ã…Â¡ÃƒÆ’Ã¢â‚¬Å¡Ãƒâ€šÃ‚Â¢ÃƒÆ’Ã†â€™Ãƒâ€ Ã¢â‚¬â„¢ÃƒÆ’Ã¢â‚¬Â ÃƒÂ¢Ã¢â€šÂ¬Ã¢â€žÂ¢ÃƒÆ’Ã†â€™ÃƒÂ¢Ã¢â€šÂ¬Ã…Â¡ÃƒÆ’Ã¢â‚¬Å¡Ãƒâ€šÃ‚Â¢ÃƒÆ’Ã†â€™Ãƒâ€ Ã¢â‚¬â„¢ÃƒÆ’Ã¢â‚¬Å¡Ãƒâ€šÃ‚Â¢ÃƒÆ’Ã†â€™Ãƒâ€šÃ‚Â¢ÃƒÆ’Ã‚Â¢ÃƒÂ¢Ã¢â‚¬Å¡Ã‚Â¬Ãƒâ€¦Ã‚Â¡ÃƒÆ’Ã¢â‚¬Å¡Ãƒâ€šÃ‚Â¬ÃƒÆ’Ã†â€™ÃƒÂ¢Ã¢â€šÂ¬Ã‚Â¦ÃƒÆ’Ã¢â‚¬Å¡Ãƒâ€šÃ‚Â¡ÃƒÆ’Ã†â€™Ãƒâ€ Ã¢â‚¬â„¢ÃƒÆ’Ã‚Â¢ÃƒÂ¢Ã¢â‚¬Å¡Ã‚Â¬Ãƒâ€¦Ã‚Â¡ÃƒÆ’Ã†â€™ÃƒÂ¢Ã¢â€šÂ¬Ã…Â¡ÃƒÆ’Ã¢â‚¬Å¡Ãƒâ€šÃ‚Â¬ÃƒÆ’Ã†â€™Ãƒâ€ Ã¢â‚¬â„¢ÃƒÆ’Ã¢â‚¬Â ÃƒÂ¢Ã¢â€šÂ¬Ã¢â€žÂ¢ÃƒÆ’Ã†â€™Ãƒâ€šÃ‚Â¢ÃƒÆ’Ã‚Â¢ÃƒÂ¢Ã¢â€šÂ¬Ã…Â¡Ãƒâ€šÃ‚Â¬ÃƒÆ’Ã¢â‚¬Â¦Ãƒâ€šÃ‚Â¡ÃƒÆ’Ã†â€™Ãƒâ€ Ã¢â‚¬â„¢ÃƒÆ’Ã‚Â¢ÃƒÂ¢Ã¢â‚¬Å¡Ã‚Â¬Ãƒâ€¦Ã‚Â¡ÃƒÆ’Ã†â€™ÃƒÂ¢Ã¢â€šÂ¬Ã…Â¡ÃƒÆ’Ã¢â‚¬Å¡Ãƒâ€šÃ‚Â¦ÃƒÆ’Ã†â€™Ãƒâ€ Ã¢â‚¬â„¢ÃƒÆ’Ã¢â‚¬Â ÃƒÂ¢Ã¢â€šÂ¬Ã¢â€žÂ¢ÃƒÆ’Ã†â€™ÃƒÂ¢Ã¢â€šÂ¬Ã‚Â ÃƒÆ’Ã‚Â¢ÃƒÂ¢Ã¢â‚¬Å¡Ã‚Â¬ÃƒÂ¢Ã¢â‚¬Å¾Ã‚Â¢ÃƒÆ’Ã†â€™Ãƒâ€ Ã¢â‚¬â„¢ÃƒÆ’Ã‚Â¢ÃƒÂ¢Ã¢â‚¬Å¡Ã‚Â¬Ãƒâ€šÃ‚Â ÃƒÆ’Ã†â€™Ãƒâ€šÃ‚Â¢ÃƒÆ’Ã‚Â¢ÃƒÂ¢Ã¢â€šÂ¬Ã…Â¡Ãƒâ€šÃ‚Â¬ÃƒÆ’Ã‚Â¢ÃƒÂ¢Ã¢â€šÂ¬Ã…Â¾Ãƒâ€šÃ‚Â¢ÃƒÆ’Ã†â€™Ãƒâ€ Ã¢â‚¬â„¢ÃƒÆ’Ã¢â‚¬Â ÃƒÂ¢Ã¢â€šÂ¬Ã¢â€žÂ¢ÃƒÆ’Ã†â€™Ãƒâ€šÃ‚Â¢ÃƒÆ’Ã‚Â¢ÃƒÂ¢Ã¢â€šÂ¬Ã…Â¡Ãƒâ€šÃ‚Â¬ÃƒÆ’Ã¢â‚¬Â¦Ãƒâ€šÃ‚Â¡ÃƒÆ’Ã†â€™Ãƒâ€ Ã¢â‚¬â„¢ÃƒÆ’Ã‚Â¢ÃƒÂ¢Ã¢â‚¬Å¡Ã‚Â¬Ãƒâ€¦Ã‚Â¡ÃƒÆ’Ã†â€™ÃƒÂ¢Ã¢â€šÂ¬Ã…Â¡ÃƒÆ’Ã¢â‚¬Å¡Ãƒâ€šÃ‚Â¢ÃƒÆ’Ã†â€™Ãƒâ€ Ã¢â‚¬â„¢ÃƒÆ’Ã¢â‚¬Â ÃƒÂ¢Ã¢â€šÂ¬Ã¢â€žÂ¢ÃƒÆ’Ã†â€™ÃƒÂ¢Ã¢â€šÂ¬Ã‚Â ÃƒÆ’Ã‚Â¢ÃƒÂ¢Ã¢â‚¬Å¡Ã‚Â¬ÃƒÂ¢Ã¢â‚¬Å¾Ã‚Â¢ÃƒÆ’Ã†â€™Ãƒâ€ Ã¢â‚¬â„¢ÃƒÆ’Ã‚Â¢ÃƒÂ¢Ã¢â‚¬Å¡Ã‚Â¬Ãƒâ€¦Ã‚Â¡ÃƒÆ’Ã†â€™ÃƒÂ¢Ã¢â€šÂ¬Ã…Â¡ÃƒÆ’Ã¢â‚¬Å¡Ãƒâ€šÃ‚Â¢ÃƒÆ’Ã†â€™Ãƒâ€ Ã¢â‚¬â„¢ÃƒÆ’Ã¢â‚¬Â ÃƒÂ¢Ã¢â€šÂ¬Ã¢â€žÂ¢ÃƒÆ’Ã†â€™ÃƒÂ¢Ã¢â€šÂ¬Ã…Â¡ÃƒÆ’Ã¢â‚¬Å¡Ãƒâ€šÃ‚Â¢ÃƒÆ’Ã†â€™Ãƒâ€ Ã¢â‚¬â„¢ÃƒÆ’Ã¢â‚¬Å¡Ãƒâ€šÃ‚Â¢ÃƒÆ’Ã†â€™Ãƒâ€šÃ‚Â¢ÃƒÆ’Ã‚Â¢ÃƒÂ¢Ã¢â€šÂ¬Ã…Â¡Ãƒâ€šÃ‚Â¬ÃƒÆ’Ã¢â‚¬Â¦Ãƒâ€šÃ‚Â¡ÃƒÆ’Ã†â€™ÃƒÂ¢Ã¢â€šÂ¬Ã…Â¡ÃƒÆ’Ã¢â‚¬Å¡Ãƒâ€šÃ‚Â¬ÃƒÆ’Ã†â€™Ãƒâ€ Ã¢â‚¬â„¢ÃƒÆ’Ã‚Â¢ÃƒÂ¢Ã¢â‚¬Å¡Ã‚Â¬Ãƒâ€šÃ‚Â¦ÃƒÆ’Ã†â€™ÃƒÂ¢Ã¢â€šÂ¬Ã…Â¡ÃƒÆ’Ã¢â‚¬Å¡Ãƒâ€šÃ‚Â¡ÃƒÆ’Ã†â€™Ãƒâ€ Ã¢â‚¬â„¢ÃƒÆ’Ã¢â‚¬Â ÃƒÂ¢Ã¢â€šÂ¬Ã¢â€žÂ¢ÃƒÆ’Ã†â€™Ãƒâ€šÃ‚Â¢ÃƒÆ’Ã‚Â¢ÃƒÂ¢Ã¢â€šÂ¬Ã…Â¡Ãƒâ€šÃ‚Â¬ÃƒÆ’Ã¢â‚¬Â¦Ãƒâ€šÃ‚Â¡ÃƒÆ’Ã†â€™Ãƒâ€ Ã¢â‚¬â„¢ÃƒÆ’Ã‚Â¢ÃƒÂ¢Ã¢â‚¬Å¡Ã‚Â¬Ãƒâ€¦Ã‚Â¡ÃƒÆ’Ã†â€™ÃƒÂ¢Ã¢â€šÂ¬Ã…Â¡ÃƒÆ’Ã¢â‚¬Å¡Ãƒâ€šÃ‚Â¬ÃƒÆ’Ã†â€™Ãƒâ€ Ã¢â‚¬â„¢ÃƒÆ’Ã¢â‚¬Â ÃƒÂ¢Ã¢â€šÂ¬Ã¢â€žÂ¢ÃƒÆ’Ã†â€™ÃƒÂ¢Ã¢â€šÂ¬Ã‚Â ÃƒÆ’Ã‚Â¢ÃƒÂ¢Ã¢â‚¬Å¡Ã‚Â¬ÃƒÂ¢Ã¢â‚¬Å¾Ã‚Â¢ÃƒÆ’Ã†â€™Ãƒâ€ Ã¢â‚¬â„¢ÃƒÆ’Ã¢â‚¬Å¡Ãƒâ€šÃ‚Â¢ÃƒÆ’Ã†â€™Ãƒâ€šÃ‚Â¢ÃƒÆ’Ã‚Â¢ÃƒÂ¢Ã¢â‚¬Å¡Ã‚Â¬Ãƒâ€¦Ã‚Â¡ÃƒÆ’Ã¢â‚¬Å¡Ãƒâ€šÃ‚Â¬ÃƒÆ’Ã†â€™ÃƒÂ¢Ã¢â€šÂ¬Ã…Â¡ÃƒÆ’Ã¢â‚¬Å¡Ãƒâ€šÃ‚Â¦ÃƒÆ’Ã†â€™Ãƒâ€ Ã¢â‚¬â„¢ÃƒÆ’Ã¢â‚¬Â ÃƒÂ¢Ã¢â€šÂ¬Ã¢â€žÂ¢ÃƒÆ’Ã†â€™ÃƒÂ¢Ã¢â€šÂ¬Ã…Â¡ÃƒÆ’Ã¢â‚¬Å¡Ãƒâ€šÃ‚Â¢ÃƒÆ’Ã†â€™Ãƒâ€ Ã¢â‚¬â„¢ÃƒÆ’Ã¢â‚¬Å¡Ãƒâ€šÃ‚Â¢ÃƒÆ’Ã†â€™Ãƒâ€šÃ‚Â¢ÃƒÆ’Ã‚Â¢ÃƒÂ¢Ã¢â€šÂ¬Ã…Â¡Ãƒâ€šÃ‚Â¬ÃƒÆ’Ã¢â‚¬Â¦Ãƒâ€šÃ‚Â¡ÃƒÆ’Ã†â€™ÃƒÂ¢Ã¢â€šÂ¬Ã…Â¡ÃƒÆ’Ã¢â‚¬Å¡Ãƒâ€šÃ‚Â¬ÃƒÆ’Ã†â€™Ãƒâ€ Ã¢â‚¬â„¢ÃƒÆ’Ã‚Â¢ÃƒÂ¢Ã¢â‚¬Å¡Ã‚Â¬Ãƒâ€šÃ‚Â¦ÃƒÆ’Ã†â€™Ãƒâ€šÃ‚Â¢ÃƒÆ’Ã‚Â¢ÃƒÂ¢Ã¢â€šÂ¬Ã…Â¡Ãƒâ€šÃ‚Â¬ÃƒÆ’Ã¢â‚¬Â¦ÃƒÂ¢Ã¢â€šÂ¬Ã…â€œnsÃƒÆ’Ã†â€™Ãƒâ€ Ã¢â‚¬â„¢ÃƒÆ’Ã¢â‚¬Â ÃƒÂ¢Ã¢â€šÂ¬Ã¢â€žÂ¢ÃƒÆ’Ã†â€™ÃƒÂ¢Ã¢â€šÂ¬Ã‚Â ÃƒÆ’Ã‚Â¢ÃƒÂ¢Ã¢â‚¬Å¡Ã‚Â¬ÃƒÂ¢Ã¢â‚¬Å¾Ã‚Â¢ÃƒÆ’Ã†â€™Ãƒâ€ Ã¢â‚¬â„¢ÃƒÆ’Ã‚Â¢ÃƒÂ¢Ã¢â‚¬Å¡Ã‚Â¬Ãƒâ€šÃ‚Â ÃƒÆ’Ã†â€™Ãƒâ€šÃ‚Â¢ÃƒÆ’Ã‚Â¢ÃƒÂ¢Ã¢â€šÂ¬Ã…Â¡Ãƒâ€šÃ‚Â¬ÃƒÆ’Ã‚Â¢ÃƒÂ¢Ã¢â€šÂ¬Ã…Â¾Ãƒâ€šÃ‚Â¢ÃƒÆ’Ã†â€™Ãƒâ€ Ã¢â‚¬â„¢ÃƒÆ’Ã¢â‚¬Â ÃƒÂ¢Ã¢â€šÂ¬Ã¢â€žÂ¢ÃƒÆ’Ã†â€™Ãƒâ€šÃ‚Â¢ÃƒÆ’Ã‚Â¢ÃƒÂ¢Ã¢â€šÂ¬Ã…Â¡Ãƒâ€šÃ‚Â¬ÃƒÆ’Ã¢â‚¬Å¡Ãƒâ€šÃ‚Â ÃƒÆ’Ã†â€™Ãƒâ€ Ã¢â‚¬â„¢ÃƒÆ’Ã¢â‚¬Å¡Ãƒâ€šÃ‚Â¢ÃƒÆ’Ã†â€™Ãƒâ€šÃ‚Â¢ÃƒÆ’Ã‚Â¢ÃƒÂ¢Ã¢â‚¬Å¡Ã‚Â¬Ãƒâ€¦Ã‚Â¡ÃƒÆ’Ã¢â‚¬Å¡Ãƒâ€šÃ‚Â¬ÃƒÆ’Ã†â€™Ãƒâ€šÃ‚Â¢ÃƒÆ’Ã‚Â¢ÃƒÂ¢Ã¢â‚¬Å¡Ã‚Â¬Ãƒâ€¦Ã‚Â¾ÃƒÆ’Ã¢â‚¬Å¡Ãƒâ€šÃ‚Â¢ÃƒÆ’Ã†â€™Ãƒâ€ Ã¢â‚¬â„¢ÃƒÆ’Ã¢â‚¬Â ÃƒÂ¢Ã¢â€šÂ¬Ã¢â€žÂ¢ÃƒÆ’Ã†â€™ÃƒÂ¢Ã¢â€šÂ¬Ã‚Â ÃƒÆ’Ã‚Â¢ÃƒÂ¢Ã¢â‚¬Å¡Ã‚Â¬ÃƒÂ¢Ã¢â‚¬Å¾Ã‚Â¢ÃƒÆ’Ã†â€™Ãƒâ€ Ã¢â‚¬â„¢ÃƒÆ’Ã¢â‚¬Å¡Ãƒâ€šÃ‚Â¢ÃƒÆ’Ã†â€™Ãƒâ€šÃ‚Â¢ÃƒÆ’Ã‚Â¢ÃƒÂ¢Ã¢â‚¬Å¡Ã‚Â¬Ãƒâ€¦Ã‚Â¡ÃƒÆ’Ã¢â‚¬Å¡Ãƒâ€šÃ‚Â¬ÃƒÆ’Ã†â€™ÃƒÂ¢Ã¢â€šÂ¬Ã…Â¡ÃƒÆ’Ã¢â‚¬Å¡Ãƒâ€šÃ‚Â ÃƒÆ’Ã†â€™Ãƒâ€ Ã¢â‚¬â„¢ÃƒÆ’Ã¢â‚¬Â ÃƒÂ¢Ã¢â€šÂ¬Ã¢â€žÂ¢ÃƒÆ’Ã†â€™ÃƒÂ¢Ã¢â€šÂ¬Ã…Â¡ÃƒÆ’Ã¢â‚¬Å¡Ãƒâ€šÃ‚Â¢ÃƒÆ’Ã†â€™Ãƒâ€ Ã¢â‚¬â„¢ÃƒÆ’Ã¢â‚¬Å¡Ãƒâ€šÃ‚Â¢ÃƒÆ’Ã†â€™Ãƒâ€šÃ‚Â¢ÃƒÆ’Ã‚Â¢ÃƒÂ¢Ã¢â€šÂ¬Ã…Â¡Ãƒâ€šÃ‚Â¬ÃƒÆ’Ã¢â‚¬Â¦Ãƒâ€šÃ‚Â¡ÃƒÆ’Ã†â€™ÃƒÂ¢Ã¢â€šÂ¬Ã…Â¡ÃƒÆ’Ã¢â‚¬Å¡Ãƒâ€šÃ‚Â¬ÃƒÆ’Ã†â€™Ãƒâ€ Ã¢â‚¬â„¢ÃƒÆ’Ã¢â‚¬Å¡Ãƒâ€šÃ‚Â¢ÃƒÆ’Ã†â€™Ãƒâ€šÃ‚Â¢ÃƒÆ’Ã‚Â¢ÃƒÂ¢Ã¢â€šÂ¬Ã…Â¡Ãƒâ€šÃ‚Â¬ÃƒÆ’Ã¢â‚¬Â¦Ãƒâ€šÃ‚Â¾ÃƒÆ’Ã†â€™ÃƒÂ¢Ã¢â€šÂ¬Ã…Â¡ÃƒÆ’Ã¢â‚¬Å¡Ãƒâ€šÃ‚Â¢ÃƒÆ’Ã†â€™Ãƒâ€ Ã¢â‚¬â„¢ÃƒÆ’Ã¢â‚¬Â ÃƒÂ¢Ã¢â€šÂ¬Ã¢â€žÂ¢ÃƒÆ’Ã†â€™ÃƒÂ¢Ã¢â€šÂ¬Ã‚Â ÃƒÆ’Ã‚Â¢ÃƒÂ¢Ã¢â‚¬Å¡Ã‚Â¬ÃƒÂ¢Ã¢â‚¬Å¾Ã‚Â¢ÃƒÆ’Ã†â€™Ãƒâ€ Ã¢â‚¬â„¢ÃƒÆ’Ã‚Â¢ÃƒÂ¢Ã¢â‚¬Å¡Ã‚Â¬Ãƒâ€šÃ‚Â ÃƒÆ’Ã†â€™Ãƒâ€šÃ‚Â¢ÃƒÆ’Ã‚Â¢ÃƒÂ¢Ã¢â€šÂ¬Ã…Â¡Ãƒâ€šÃ‚Â¬ÃƒÆ’Ã‚Â¢ÃƒÂ¢Ã¢â€šÂ¬Ã…Â¾Ãƒâ€šÃ‚Â¢ÃƒÆ’Ã†â€™Ãƒâ€ Ã¢â‚¬â„¢ÃƒÆ’Ã¢â‚¬Â ÃƒÂ¢Ã¢â€šÂ¬Ã¢â€žÂ¢ÃƒÆ’Ã†â€™ÃƒÂ¢Ã¢â€šÂ¬Ã…Â¡ÃƒÆ’Ã¢â‚¬Å¡Ãƒâ€šÃ‚Â¢ÃƒÆ’Ã†â€™Ãƒâ€ Ã¢â‚¬â„¢ÃƒÆ’Ã¢â‚¬Å¡Ãƒâ€šÃ‚Â¢ÃƒÆ’Ã†â€™Ãƒâ€šÃ‚Â¢ÃƒÆ’Ã‚Â¢ÃƒÂ¢Ã¢â€šÂ¬Ã…Â¡Ãƒâ€šÃ‚Â¬ÃƒÆ’Ã¢â‚¬Â¦Ãƒâ€šÃ‚Â¡ÃƒÆ’Ã†â€™ÃƒÂ¢Ã¢â€šÂ¬Ã…Â¡ÃƒÆ’Ã¢â‚¬Å¡Ãƒâ€šÃ‚Â¬ÃƒÆ’Ã†â€™Ãƒâ€ Ã¢â‚¬â„¢ÃƒÆ’Ã‚Â¢ÃƒÂ¢Ã¢â‚¬Å¡Ã‚Â¬Ãƒâ€šÃ‚Â¦ÃƒÆ’Ã†â€™ÃƒÂ¢Ã¢â€šÂ¬Ã…Â¡ÃƒÆ’Ã¢â‚¬Å¡Ãƒâ€šÃ‚Â¡ÃƒÆ’Ã†â€™Ãƒâ€ Ã¢â‚¬â„¢ÃƒÆ’Ã¢â‚¬Â ÃƒÂ¢Ã¢â€šÂ¬Ã¢â€žÂ¢ÃƒÆ’Ã†â€™ÃƒÂ¢Ã¢â€šÂ¬Ã‚Â ÃƒÆ’Ã‚Â¢ÃƒÂ¢Ã¢â‚¬Å¡Ã‚Â¬ÃƒÂ¢Ã¢â‚¬Å¾Ã‚Â¢ÃƒÆ’Ã†â€™Ãƒâ€ Ã¢â‚¬â„¢ÃƒÆ’Ã¢â‚¬Å¡Ãƒâ€šÃ‚Â¢ÃƒÆ’Ã†â€™Ãƒâ€šÃ‚Â¢ÃƒÆ’Ã‚Â¢ÃƒÂ¢Ã¢â‚¬Å¡Ã‚Â¬Ãƒâ€¦Ã‚Â¡ÃƒÆ’Ã¢â‚¬Å¡Ãƒâ€šÃ‚Â¬ÃƒÆ’Ã†â€™ÃƒÂ¢Ã¢â€šÂ¬Ã‚Â¦ÃƒÆ’Ã¢â‚¬Å¡Ãƒâ€šÃ‚Â¡ÃƒÆ’Ã†â€™Ãƒâ€ Ã¢â‚¬â„¢ÃƒÆ’Ã¢â‚¬Â ÃƒÂ¢Ã¢â€šÂ¬Ã¢â€žÂ¢ÃƒÆ’Ã†â€™Ãƒâ€šÃ‚Â¢ÃƒÆ’Ã‚Â¢ÃƒÂ¢Ã¢â€šÂ¬Ã…Â¡Ãƒâ€šÃ‚Â¬ÃƒÆ’Ã¢â‚¬Â¦Ãƒâ€šÃ‚Â¡ÃƒÆ’Ã†â€™Ãƒâ€ Ã¢â‚¬â„¢ÃƒÆ’Ã‚Â¢ÃƒÂ¢Ã¢â‚¬Å¡Ã‚Â¬Ãƒâ€¦Ã‚Â¡ÃƒÆ’Ã†â€™ÃƒÂ¢Ã¢â€šÂ¬Ã…Â¡ÃƒÆ’Ã¢â‚¬Å¡Ãƒâ€šÃ‚Â¢ÃƒÆ’Ã†â€™Ãƒâ€ Ã¢â‚¬â„¢ÃƒÆ’Ã¢â‚¬Â ÃƒÂ¢Ã¢â€šÂ¬Ã¢â€žÂ¢ÃƒÆ’Ã†â€™ÃƒÂ¢Ã¢â€šÂ¬Ã‚Â ÃƒÆ’Ã‚Â¢ÃƒÂ¢Ã¢â‚¬Å¡Ã‚Â¬ÃƒÂ¢Ã¢â‚¬Å¾Ã‚Â¢ÃƒÆ’Ã†â€™Ãƒâ€ Ã¢â‚¬â„¢ÃƒÆ’Ã‚Â¢ÃƒÂ¢Ã¢â‚¬Å¡Ã‚Â¬Ãƒâ€šÃ‚Â ÃƒÆ’Ã†â€™Ãƒâ€šÃ‚Â¢ÃƒÆ’Ã‚Â¢ÃƒÂ¢Ã¢â€šÂ¬Ã…Â¡Ãƒâ€šÃ‚Â¬ÃƒÆ’Ã‚Â¢ÃƒÂ¢Ã¢â€šÂ¬Ã…Â¾Ãƒâ€šÃ‚Â¢ÃƒÆ’Ã†â€™Ãƒâ€ Ã¢â‚¬â„¢ÃƒÆ’Ã¢â‚¬Â ÃƒÂ¢Ã¢â€šÂ¬Ã¢â€žÂ¢ÃƒÆ’Ã†â€™Ãƒâ€šÃ‚Â¢ÃƒÆ’Ã‚Â¢ÃƒÂ¢Ã¢â€šÂ¬Ã…Â¡Ãƒâ€šÃ‚Â¬ÃƒÆ’Ã¢â‚¬Å¡Ãƒâ€šÃ‚Â ÃƒÆ’Ã†â€™Ãƒâ€ Ã¢â‚¬â„¢ÃƒÆ’Ã¢â‚¬Å¡Ãƒâ€šÃ‚Â¢ÃƒÆ’Ã†â€™Ãƒâ€šÃ‚Â¢ÃƒÆ’Ã‚Â¢ÃƒÂ¢Ã¢â‚¬Å¡Ã‚Â¬Ãƒâ€¦Ã‚Â¡ÃƒÆ’Ã¢â‚¬Å¡Ãƒâ€šÃ‚Â¬ÃƒÆ’Ã†â€™Ãƒâ€šÃ‚Â¢ÃƒÆ’Ã‚Â¢ÃƒÂ¢Ã¢â‚¬Å¡Ã‚Â¬Ãƒâ€¦Ã‚Â¾ÃƒÆ’Ã¢â‚¬Å¡Ãƒâ€šÃ‚Â¢ÃƒÆ’Ã†â€™Ãƒâ€ Ã¢â‚¬â„¢ÃƒÆ’Ã¢â‚¬Â ÃƒÂ¢Ã¢â€šÂ¬Ã¢â€žÂ¢ÃƒÆ’Ã†â€™ÃƒÂ¢Ã¢â€šÂ¬Ã‚Â ÃƒÆ’Ã‚Â¢ÃƒÂ¢Ã¢â‚¬Å¡Ã‚Â¬ÃƒÂ¢Ã¢â‚¬Å¾Ã‚Â¢ÃƒÆ’Ã†â€™Ãƒâ€ Ã¢â‚¬â„¢ÃƒÆ’Ã¢â‚¬Å¡Ãƒâ€šÃ‚Â¢ÃƒÆ’Ã†â€™Ãƒâ€šÃ‚Â¢ÃƒÆ’Ã‚Â¢ÃƒÂ¢Ã¢â‚¬Å¡Ã‚Â¬Ãƒâ€¦Ã‚Â¡ÃƒÆ’Ã¢â‚¬Å¡Ãƒâ€šÃ‚Â¬ÃƒÆ’Ã†â€™ÃƒÂ¢Ã¢â€šÂ¬Ã‚Â¦ÃƒÆ’Ã¢â‚¬Å¡Ãƒâ€šÃ‚Â¡ÃƒÆ’Ã†â€™Ãƒâ€ Ã¢â‚¬â„¢ÃƒÆ’Ã¢â‚¬Â ÃƒÂ¢Ã¢â€šÂ¬Ã¢â€žÂ¢ÃƒÆ’Ã†â€™Ãƒâ€šÃ‚Â¢ÃƒÆ’Ã‚Â¢ÃƒÂ¢Ã¢â€šÂ¬Ã…Â¡Ãƒâ€šÃ‚Â¬ÃƒÆ’Ã¢â‚¬Â¦Ãƒâ€šÃ‚Â¡ÃƒÆ’Ã†â€™Ãƒâ€ Ã¢â‚¬â„¢ÃƒÆ’Ã‚Â¢ÃƒÂ¢Ã¢â‚¬Å¡Ã‚Â¬Ãƒâ€¦Ã‚Â¡ÃƒÆ’Ã†â€™ÃƒÂ¢Ã¢â€šÂ¬Ã…Â¡ÃƒÆ’Ã¢â‚¬Å¡Ãƒâ€šÃ‚Â¢ÃƒÆ’Ã†â€™Ãƒâ€ Ã¢â‚¬â„¢ÃƒÆ’Ã¢â‚¬Â ÃƒÂ¢Ã¢â€šÂ¬Ã¢â€žÂ¢ÃƒÆ’Ã†â€™ÃƒÂ¢Ã¢â€šÂ¬Ã‚Â ÃƒÆ’Ã‚Â¢ÃƒÂ¢Ã¢â‚¬Å¡Ã‚Â¬ÃƒÂ¢Ã¢â‚¬Å¾Ã‚Â¢ÃƒÆ’Ã†â€™Ãƒâ€ Ã¢â‚¬â„¢ÃƒÆ’Ã‚Â¢ÃƒÂ¢Ã¢â‚¬Å¡Ã‚Â¬Ãƒâ€šÃ‚Â ÃƒÆ’Ã†â€™Ãƒâ€šÃ‚Â¢ÃƒÆ’Ã‚Â¢ÃƒÂ¢Ã¢â€šÂ¬Ã…Â¡Ãƒâ€šÃ‚Â¬ÃƒÆ’Ã‚Â¢ÃƒÂ¢Ã¢â€šÂ¬Ã…Â¾Ãƒâ€šÃ‚Â¢ÃƒÆ’Ã†â€™Ãƒâ€ Ã¢â‚¬â„¢ÃƒÆ’Ã¢â‚¬Â ÃƒÂ¢Ã¢â€šÂ¬Ã¢â€žÂ¢ÃƒÆ’Ã†â€™Ãƒâ€šÃ‚Â¢ÃƒÆ’Ã‚Â¢ÃƒÂ¢Ã¢â€šÂ¬Ã…Â¡Ãƒâ€šÃ‚Â¬ÃƒÆ’Ã¢â‚¬Â¦Ãƒâ€šÃ‚Â¡ÃƒÆ’Ã†â€™Ãƒâ€ Ã¢â‚¬â„¢ÃƒÆ’Ã‚Â¢ÃƒÂ¢Ã¢â‚¬Å¡Ã‚Â¬Ãƒâ€¦Ã‚Â¡ÃƒÆ’Ã†â€™ÃƒÂ¢Ã¢â€šÂ¬Ã…Â¡ÃƒÆ’Ã¢â‚¬Å¡Ãƒâ€šÃ‚Â¢ÃƒÆ’Ã†â€™Ãƒâ€ Ã¢â‚¬â„¢ÃƒÆ’Ã¢â‚¬Â ÃƒÂ¢Ã¢â€šÂ¬Ã¢â€žÂ¢ÃƒÆ’Ã†â€™ÃƒÂ¢Ã¢â€šÂ¬Ã‚Â ÃƒÆ’Ã‚Â¢ÃƒÂ¢Ã¢â‚¬Å¡Ã‚Â¬ÃƒÂ¢Ã¢â‚¬Å¾Ã‚Â¢ÃƒÆ’Ã†â€™Ãƒâ€ Ã¢â‚¬â„¢ÃƒÆ’Ã‚Â¢ÃƒÂ¢Ã¢â‚¬Å¡Ã‚Â¬Ãƒâ€¦Ã‚Â¡ÃƒÆ’Ã†â€™ÃƒÂ¢Ã¢â€šÂ¬Ã…Â¡ÃƒÆ’Ã¢â‚¬Å¡Ãƒâ€šÃ‚Â¢ÃƒÆ’Ã†â€™Ãƒâ€ Ã¢â‚¬â„¢ÃƒÆ’Ã¢â‚¬Â ÃƒÂ¢Ã¢â€šÂ¬Ã¢â€žÂ¢ÃƒÆ’Ã†â€™ÃƒÂ¢Ã¢â€šÂ¬Ã…Â¡ÃƒÆ’Ã¢â‚¬Å¡Ãƒâ€šÃ‚Â¢ÃƒÆ’Ã†â€™Ãƒâ€ Ã¢â‚¬â„¢ÃƒÆ’Ã¢â‚¬Å¡Ãƒâ€šÃ‚Â¢ÃƒÆ’Ã†â€™Ãƒâ€šÃ‚Â¢ÃƒÆ’Ã‚Â¢ÃƒÂ¢Ã¢â€šÂ¬Ã…Â¡Ãƒâ€šÃ‚Â¬ÃƒÆ’Ã¢â‚¬Â¦Ãƒâ€šÃ‚Â¡ÃƒÆ’Ã†â€™ÃƒÂ¢Ã¢â€šÂ¬Ã…Â¡ÃƒÆ’Ã¢â‚¬Å¡Ãƒâ€šÃ‚Â¬ÃƒÆ’Ã†â€™Ãƒâ€ Ã¢â‚¬â„¢ÃƒÆ’Ã‚Â¢ÃƒÂ¢Ã¢â‚¬Å¡Ã‚Â¬Ãƒâ€šÃ‚Â¦ÃƒÆ’Ã†â€™ÃƒÂ¢Ã¢â€šÂ¬Ã…Â¡ÃƒÆ’Ã¢â‚¬Å¡Ãƒâ€šÃ‚Â¡ÃƒÆ’Ã†â€™Ãƒâ€ Ã¢â‚¬â„¢ÃƒÆ’Ã¢â‚¬Â ÃƒÂ¢Ã¢â€šÂ¬Ã¢â€žÂ¢ÃƒÆ’Ã†â€™Ãƒâ€šÃ‚Â¢ÃƒÆ’Ã‚Â¢ÃƒÂ¢Ã¢â€šÂ¬Ã…Â¡Ãƒâ€šÃ‚Â¬ÃƒÆ’Ã¢â‚¬Â¦Ãƒâ€šÃ‚Â¡ÃƒÆ’Ã†â€™Ãƒâ€ Ã¢â‚¬â„¢ÃƒÆ’Ã‚Â¢ÃƒÂ¢Ã¢â‚¬Å¡Ã‚Â¬Ãƒâ€¦Ã‚Â¡ÃƒÆ’Ã†â€™ÃƒÂ¢Ã¢â€šÂ¬Ã…Â¡ÃƒÆ’Ã¢â‚¬Å¡Ãƒâ€šÃ‚Â¬ÃƒÆ’Ã†â€™Ãƒâ€ Ã¢â‚¬â„¢ÃƒÆ’Ã¢â‚¬Â ÃƒÂ¢Ã¢â€šÂ¬Ã¢â€žÂ¢ÃƒÆ’Ã†â€™ÃƒÂ¢Ã¢â€šÂ¬Ã‚Â ÃƒÆ’Ã‚Â¢ÃƒÂ¢Ã¢â‚¬Å¡Ã‚Â¬ÃƒÂ¢Ã¢â‚¬Å¾Ã‚Â¢ÃƒÆ’Ã†â€™Ãƒâ€ Ã¢â‚¬â„¢ÃƒÆ’Ã¢â‚¬Å¡Ãƒâ€šÃ‚Â¢ÃƒÆ’Ã†â€™Ãƒâ€šÃ‚Â¢ÃƒÆ’Ã‚Â¢ÃƒÂ¢Ã¢â‚¬Å¡Ã‚Â¬Ãƒâ€¦Ã‚Â¡ÃƒÆ’Ã¢â‚¬Å¡Ãƒâ€šÃ‚Â¬ÃƒÆ’Ã†â€™ÃƒÂ¢Ã¢â€šÂ¬Ã…Â¡ÃƒÆ’Ã¢â‚¬Å¡Ãƒâ€šÃ‚Â¦ÃƒÆ’Ã†â€™Ãƒâ€ Ã¢â‚¬â„¢ÃƒÆ’Ã¢â‚¬Â ÃƒÂ¢Ã¢â€šÂ¬Ã¢â€žÂ¢ÃƒÆ’Ã†â€™Ãƒâ€šÃ‚Â¢ÃƒÆ’Ã‚Â¢ÃƒÂ¢Ã¢â€šÂ¬Ã…Â¡Ãƒâ€šÃ‚Â¬ÃƒÆ’Ã¢â‚¬Â¦Ãƒâ€šÃ‚Â¡ÃƒÆ’Ã†â€™Ãƒâ€ Ã¢â‚¬â„¢ÃƒÆ’Ã‚Â¢ÃƒÂ¢Ã¢â‚¬Å¡Ã‚Â¬Ãƒâ€¦Ã‚Â¡ÃƒÆ’Ã†â€™ÃƒÂ¢Ã¢â€šÂ¬Ã…Â¡ÃƒÆ’Ã¢â‚¬Å¡Ãƒâ€šÃ‚Â¡ÃƒÆ’Ã†â€™Ãƒâ€ Ã¢â‚¬â„¢ÃƒÆ’Ã¢â‚¬Â ÃƒÂ¢Ã¢â€šÂ¬Ã¢â€žÂ¢ÃƒÆ’Ã†â€™ÃƒÂ¢Ã¢â€šÂ¬Ã‚Â ÃƒÆ’Ã‚Â¢ÃƒÂ¢Ã¢â‚¬Å¡Ã‚Â¬ÃƒÂ¢Ã¢â‚¬Å¾Ã‚Â¢ÃƒÆ’Ã†â€™Ãƒâ€ Ã¢â‚¬â„¢ÃƒÆ’Ã‚Â¢ÃƒÂ¢Ã¢â‚¬Å¡Ã‚Â¬Ãƒâ€šÃ‚Â ÃƒÆ’Ã†â€™Ãƒâ€šÃ‚Â¢ÃƒÆ’Ã‚Â¢ÃƒÂ¢Ã¢â€šÂ¬Ã…Â¡Ãƒâ€šÃ‚Â¬ÃƒÆ’Ã‚Â¢ÃƒÂ¢Ã¢â€šÂ¬Ã…Â¾Ãƒâ€šÃ‚Â¢ÃƒÆ’Ã†â€™Ãƒâ€ Ã¢â‚¬â„¢ÃƒÆ’Ã¢â‚¬Â ÃƒÂ¢Ã¢â€šÂ¬Ã¢â€žÂ¢ÃƒÆ’Ã†â€™ÃƒÂ¢Ã¢â€šÂ¬Ã…Â¡ÃƒÆ’Ã¢â‚¬Å¡Ãƒâ€šÃ‚Â¢ÃƒÆ’Ã†â€™Ãƒâ€ Ã¢â‚¬â„¢ÃƒÆ’Ã¢â‚¬Å¡Ãƒâ€šÃ‚Â¢ÃƒÆ’Ã†â€™Ãƒâ€šÃ‚Â¢ÃƒÆ’Ã‚Â¢ÃƒÂ¢Ã¢â€šÂ¬Ã…Â¡Ãƒâ€šÃ‚Â¬ÃƒÆ’Ã¢â‚¬Â¦Ãƒâ€šÃ‚Â¡ÃƒÆ’Ã†â€™ÃƒÂ¢Ã¢â€šÂ¬Ã…Â¡ÃƒÆ’Ã¢â‚¬Å¡Ãƒâ€šÃ‚Â¬ÃƒÆ’Ã†â€™Ãƒâ€ Ã¢â‚¬â„¢ÃƒÆ’Ã‚Â¢ÃƒÂ¢Ã¢â‚¬Å¡Ã‚Â¬Ãƒâ€šÃ‚Â¦ÃƒÆ’Ã†â€™ÃƒÂ¢Ã¢â€šÂ¬Ã…Â¡ÃƒÆ’Ã¢â‚¬Å¡Ãƒâ€šÃ‚Â¡ÃƒÆ’Ã†â€™Ãƒâ€ Ã¢â‚¬â„¢ÃƒÆ’Ã¢â‚¬Â ÃƒÂ¢Ã¢â€šÂ¬Ã¢â€žÂ¢ÃƒÆ’Ã†â€™ÃƒÂ¢Ã¢â€šÂ¬Ã‚Â ÃƒÆ’Ã‚Â¢ÃƒÂ¢Ã¢â‚¬Å¡Ã‚Â¬ÃƒÂ¢Ã¢â‚¬Å¾Ã‚Â¢ÃƒÆ’Ã†â€™Ãƒâ€ Ã¢â‚¬â„¢ÃƒÆ’Ã¢â‚¬Å¡Ãƒâ€šÃ‚Â¢ÃƒÆ’Ã†â€™Ãƒâ€šÃ‚Â¢ÃƒÆ’Ã‚Â¢ÃƒÂ¢Ã¢â‚¬Å¡Ã‚Â¬Ãƒâ€¦Ã‚Â¡ÃƒÆ’Ã¢â‚¬Å¡Ãƒâ€šÃ‚Â¬ÃƒÆ’Ã†â€™ÃƒÂ¢Ã¢â€šÂ¬Ã‚Â¦ÃƒÆ’Ã¢â‚¬Å¡Ãƒâ€šÃ‚Â¡ÃƒÆ’Ã†â€™Ãƒâ€ Ã¢â‚¬â„¢ÃƒÆ’Ã¢â‚¬Â ÃƒÂ¢Ã¢â€šÂ¬Ã¢â€žÂ¢ÃƒÆ’Ã†â€™Ãƒâ€šÃ‚Â¢ÃƒÆ’Ã‚Â¢ÃƒÂ¢Ã¢â€šÂ¬Ã…Â¡Ãƒâ€šÃ‚Â¬ÃƒÆ’Ã¢â‚¬Â¦Ãƒâ€šÃ‚Â¡ÃƒÆ’Ã†â€™Ãƒâ€ Ã¢â‚¬â„¢ÃƒÆ’Ã‚Â¢ÃƒÂ¢Ã¢â‚¬Å¡Ã‚Â¬Ãƒâ€¦Ã‚Â¡ÃƒÆ’Ã†â€™ÃƒÂ¢Ã¢â€šÂ¬Ã…Â¡ÃƒÆ’Ã¢â‚¬Å¡Ãƒâ€šÃ‚Â¬ÃƒÆ’Ã†â€™Ãƒâ€ Ã¢â‚¬â„¢ÃƒÆ’Ã¢â‚¬Â ÃƒÂ¢Ã¢â€šÂ¬Ã¢â€žÂ¢ÃƒÆ’Ã†â€™ÃƒÂ¢Ã¢â€šÂ¬Ã‚Â ÃƒÆ’Ã‚Â¢ÃƒÂ¢Ã¢â‚¬Å¡Ã‚Â¬ÃƒÂ¢Ã¢â‚¬Å¾Ã‚Â¢ÃƒÆ’Ã†â€™Ãƒâ€ Ã¢â‚¬â„¢ÃƒÆ’Ã‚Â¢ÃƒÂ¢Ã¢â‚¬Å¡Ã‚Â¬Ãƒâ€šÃ‚Â ÃƒÆ’Ã†â€™Ãƒâ€šÃ‚Â¢ÃƒÆ’Ã‚Â¢ÃƒÂ¢Ã¢â€šÂ¬Ã…Â¡Ãƒâ€šÃ‚Â¬ÃƒÆ’Ã‚Â¢ÃƒÂ¢Ã¢â€šÂ¬Ã…Â¾Ãƒâ€šÃ‚Â¢ÃƒÆ’Ã†â€™Ãƒâ€ Ã¢â‚¬â„¢ÃƒÆ’Ã¢â‚¬Â ÃƒÂ¢Ã¢â€šÂ¬Ã¢â€žÂ¢ÃƒÆ’Ã†â€™Ãƒâ€šÃ‚Â¢ÃƒÆ’Ã‚Â¢ÃƒÂ¢Ã¢â€šÂ¬Ã…Â¡Ãƒâ€šÃ‚Â¬ÃƒÆ’Ã¢â‚¬Å¡Ãƒâ€šÃ‚Â ÃƒÆ’Ã†â€™Ãƒâ€ Ã¢â‚¬â„¢ÃƒÆ’Ã¢â‚¬Å¡Ãƒâ€šÃ‚Â¢ÃƒÆ’Ã†â€™Ãƒâ€šÃ‚Â¢ÃƒÆ’Ã‚Â¢ÃƒÂ¢Ã¢â‚¬Å¡Ã‚Â¬Ãƒâ€¦Ã‚Â¡ÃƒÆ’Ã¢â‚¬Å¡Ãƒâ€šÃ‚Â¬ÃƒÆ’Ã†â€™Ãƒâ€šÃ‚Â¢ÃƒÆ’Ã‚Â¢ÃƒÂ¢Ã¢â‚¬Å¡Ã‚Â¬Ãƒâ€¦Ã‚Â¾ÃƒÆ’Ã¢â‚¬Å¡Ãƒâ€šÃ‚Â¢ÃƒÆ’Ã†â€™Ãƒâ€ Ã¢â‚¬â„¢ÃƒÆ’Ã¢â‚¬Â ÃƒÂ¢Ã¢â€šÂ¬Ã¢â€žÂ¢ÃƒÆ’Ã†â€™ÃƒÂ¢Ã¢â€šÂ¬Ã‚Â ÃƒÆ’Ã‚Â¢ÃƒÂ¢Ã¢â‚¬Å¡Ã‚Â¬ÃƒÂ¢Ã¢â‚¬Å¾Ã‚Â¢ÃƒÆ’Ã†â€™Ãƒâ€ Ã¢â‚¬â„¢ÃƒÆ’Ã‚Â¢ÃƒÂ¢Ã¢â‚¬Å¡Ã‚Â¬Ãƒâ€¦Ã‚Â¡ÃƒÆ’Ã†â€™ÃƒÂ¢Ã¢â€šÂ¬Ã…Â¡ÃƒÆ’Ã¢â‚¬Å¡Ãƒâ€šÃ‚Â¢ÃƒÆ’Ã†â€™Ãƒâ€ Ã¢â‚¬â„¢ÃƒÆ’Ã¢â‚¬Â ÃƒÂ¢Ã¢â€šÂ¬Ã¢â€žÂ¢ÃƒÆ’Ã†â€™ÃƒÂ¢Ã¢â€šÂ¬Ã…Â¡ÃƒÆ’Ã¢â‚¬Å¡Ãƒâ€šÃ‚Â¢ÃƒÆ’Ã†â€™Ãƒâ€ Ã¢â‚¬â„¢ÃƒÆ’Ã¢â‚¬Å¡Ãƒâ€šÃ‚Â¢ÃƒÆ’Ã†â€™Ãƒâ€šÃ‚Â¢ÃƒÆ’Ã‚Â¢ÃƒÂ¢Ã¢â‚¬Å¡Ã‚Â¬Ãƒâ€¦Ã‚Â¡ÃƒÆ’Ã¢â‚¬Å¡Ãƒâ€šÃ‚Â¬ÃƒÆ’Ã†â€™ÃƒÂ¢Ã¢â€šÂ¬Ã‚Â¦ÃƒÆ’Ã¢â‚¬Å¡Ãƒâ€šÃ‚Â¡ÃƒÆ’Ã†â€™Ãƒâ€ Ã¢â‚¬â„¢ÃƒÆ’Ã‚Â¢ÃƒÂ¢Ã¢â‚¬Å¡Ã‚Â¬Ãƒâ€¦Ã‚Â¡ÃƒÆ’Ã†â€™ÃƒÂ¢Ã¢â€šÂ¬Ã…Â¡ÃƒÆ’Ã¢â‚¬Å¡Ãƒâ€šÃ‚Â¬ÃƒÆ’Ã†â€™Ãƒâ€ Ã¢â‚¬â„¢ÃƒÆ’Ã¢â‚¬Â ÃƒÂ¢Ã¢â€šÂ¬Ã¢â€žÂ¢ÃƒÆ’Ã†â€™Ãƒâ€šÃ‚Â¢ÃƒÆ’Ã‚Â¢ÃƒÂ¢Ã¢â€šÂ¬Ã…Â¡Ãƒâ€šÃ‚Â¬ÃƒÆ’Ã¢â‚¬Å¡Ãƒâ€šÃ‚Â¦ÃƒÆ’Ã†â€™Ãƒâ€ Ã¢â‚¬â„¢ÃƒÆ’Ã‚Â¢ÃƒÂ¢Ã¢â‚¬Å¡Ã‚Â¬Ãƒâ€¦Ã‚Â¡ÃƒÆ’Ã†â€™ÃƒÂ¢Ã¢â€šÂ¬Ã…Â¡ÃƒÆ’Ã¢â‚¬Å¡Ãƒâ€šÃ‚Â¡ÃƒÆ’Ã†â€™Ãƒâ€ Ã¢â‚¬â„¢ÃƒÆ’Ã¢â‚¬Â ÃƒÂ¢Ã¢â€šÂ¬Ã¢â€žÂ¢ÃƒÆ’Ã†â€™ÃƒÂ¢Ã¢â€šÂ¬Ã‚Â ÃƒÆ’Ã‚Â¢ÃƒÂ¢Ã¢â‚¬Å¡Ã‚Â¬ÃƒÂ¢Ã¢â‚¬Å¾Ã‚Â¢ÃƒÆ’Ã†â€™Ãƒâ€ Ã¢â‚¬â„¢ÃƒÆ’Ã‚Â¢ÃƒÂ¢Ã¢â‚¬Å¡Ã‚Â¬Ãƒâ€šÃ‚Â ÃƒÆ’Ã†â€™Ãƒâ€šÃ‚Â¢ÃƒÆ’Ã‚Â¢ÃƒÂ¢Ã¢â€šÂ¬Ã…Â¡Ãƒâ€šÃ‚Â¬ÃƒÆ’Ã‚Â¢ÃƒÂ¢Ã¢â€šÂ¬Ã…Â¾Ãƒâ€šÃ‚Â¢ÃƒÆ’Ã†â€™Ãƒâ€ Ã¢â‚¬â„¢ÃƒÆ’Ã¢â‚¬Â ÃƒÂ¢Ã¢â€šÂ¬Ã¢â€žÂ¢ÃƒÆ’Ã†â€™ÃƒÂ¢Ã¢â€šÂ¬Ã…Â¡ÃƒÆ’Ã¢â‚¬Å¡Ãƒâ€šÃ‚Â¢ÃƒÆ’Ã†â€™Ãƒâ€ Ã¢â‚¬â„¢ÃƒÆ’Ã¢â‚¬Å¡Ãƒâ€šÃ‚Â¢ÃƒÆ’Ã†â€™Ãƒâ€šÃ‚Â¢ÃƒÆ’Ã‚Â¢ÃƒÂ¢Ã¢â€šÂ¬Ã…Â¡Ãƒâ€šÃ‚Â¬ÃƒÆ’Ã¢â‚¬Â¦Ãƒâ€šÃ‚Â¡ÃƒÆ’Ã†â€™ÃƒÂ¢Ã¢â€šÂ¬Ã…Â¡ÃƒÆ’Ã¢â‚¬Å¡Ãƒâ€šÃ‚Â¬ÃƒÆ’Ã†â€™Ãƒâ€ Ã¢â‚¬â„¢ÃƒÆ’Ã‚Â¢ÃƒÂ¢Ã¢â‚¬Å¡Ã‚Â¬Ãƒâ€šÃ‚Â¦ÃƒÆ’Ã†â€™ÃƒÂ¢Ã¢â€šÂ¬Ã…Â¡ÃƒÆ’Ã¢â‚¬Å¡Ãƒâ€šÃ‚Â¡ÃƒÆ’Ã†â€™Ãƒâ€ Ã¢â‚¬â„¢ÃƒÆ’Ã¢â‚¬Â ÃƒÂ¢Ã¢â€šÂ¬Ã¢â€žÂ¢ÃƒÆ’Ã†â€™ÃƒÂ¢Ã¢â€šÂ¬Ã‚Â ÃƒÆ’Ã‚Â¢ÃƒÂ¢Ã¢â‚¬Å¡Ã‚Â¬ÃƒÂ¢Ã¢â‚¬Å¾Ã‚Â¢ÃƒÆ’Ã†â€™Ãƒâ€ Ã¢â‚¬â„¢ÃƒÆ’Ã¢â‚¬Å¡Ãƒâ€šÃ‚Â¢ÃƒÆ’Ã†â€™Ãƒâ€šÃ‚Â¢ÃƒÆ’Ã‚Â¢ÃƒÂ¢Ã¢â‚¬Å¡Ã‚Â¬Ãƒâ€¦Ã‚Â¡ÃƒÆ’Ã¢â‚¬Å¡Ãƒâ€šÃ‚Â¬ÃƒÆ’Ã†â€™ÃƒÂ¢Ã¢â€šÂ¬Ã‚Â¦ÃƒÆ’Ã¢â‚¬Å¡Ãƒâ€šÃ‚Â¡ÃƒÆ’Ã†â€™Ãƒâ€ Ã¢â‚¬â„¢ÃƒÆ’Ã¢â‚¬Â ÃƒÂ¢Ã¢â€šÂ¬Ã¢â€žÂ¢ÃƒÆ’Ã†â€™Ãƒâ€šÃ‚Â¢ÃƒÆ’Ã‚Â¢ÃƒÂ¢Ã¢â€šÂ¬Ã…Â¡Ãƒâ€šÃ‚Â¬ÃƒÆ’Ã¢â‚¬Â¦Ãƒâ€šÃ‚Â¡ÃƒÆ’Ã†â€™Ãƒâ€ Ã¢â‚¬â„¢ÃƒÆ’Ã‚Â¢ÃƒÂ¢Ã¢â‚¬Å¡Ã‚Â¬Ãƒâ€¦Ã‚Â¡ÃƒÆ’Ã†â€™ÃƒÂ¢Ã¢â€šÂ¬Ã…Â¡ÃƒÆ’Ã¢â‚¬Å¡Ãƒâ€šÃ‚Â (non-significant) labels in the pairwise comparisons, confirming that none of the replicates differed meaningfully from each other.</w:t>
       </w:r>
     </w:p>
     <w:p>
@@ -6279,7 +6279,7 @@
         <w:rPr>
           <w:rFonts w:ascii="Times New Roman" w:hAnsi="Times New Roman" w:cs="Times New Roman"/>
         </w:rPr>
-        <w:t>The line graph illustrates the weekly changes in Total Dissolved Solids (TDS), measured in parts per thousand (ppt), for Integrated Multi-Trophic Aquaculture (IMTA) and Monoculture treatments over a seven-week period. At the beginning of the study (Week 1), both treatments recorded identical TDS levels of approximately 16.5 ppt. During the early phase (Weeks 2ÃƒÆ’Ã†â€™Ãƒâ€ Ã¢â‚¬â„¢ÃƒÆ’Ã¢â‚¬Â ÃƒÂ¢Ã¢â€šÂ¬Ã¢â€žÂ¢ÃƒÆ’Ã†â€™ÃƒÂ¢Ã¢â€šÂ¬Ã‚Â ÃƒÆ’Ã‚Â¢ÃƒÂ¢Ã¢â‚¬Å¡Ã‚Â¬ÃƒÂ¢Ã¢â‚¬Å¾Ã‚Â¢ÃƒÆ’Ã†â€™Ãƒâ€ Ã¢â‚¬â„¢ÃƒÆ’Ã‚Â¢ÃƒÂ¢Ã¢â‚¬Å¡Ã‚Â¬Ãƒâ€šÃ‚Â ÃƒÆ’Ã†â€™Ãƒâ€šÃ‚Â¢ÃƒÆ’Ã‚Â¢ÃƒÂ¢Ã¢â€šÂ¬Ã…Â¡Ãƒâ€šÃ‚Â¬ÃƒÆ’Ã‚Â¢ÃƒÂ¢Ã¢â€šÂ¬Ã…Â¾Ãƒâ€šÃ‚Â¢ÃƒÆ’Ã†â€™Ãƒâ€ Ã¢â‚¬â„¢ÃƒÆ’Ã¢â‚¬Â ÃƒÂ¢Ã¢â€šÂ¬Ã¢â€žÂ¢ÃƒÆ’Ã†â€™Ãƒâ€šÃ‚Â¢ÃƒÆ’Ã‚Â¢ÃƒÂ¢Ã¢â€šÂ¬Ã…Â¡Ãƒâ€šÃ‚Â¬ÃƒÆ’Ã¢â‚¬Å¡Ãƒâ€šÃ‚Â ÃƒÆ’Ã†â€™Ãƒâ€ Ã¢â‚¬â„¢ÃƒÆ’Ã¢â‚¬Å¡Ãƒâ€šÃ‚Â¢ÃƒÆ’Ã†â€™Ãƒâ€šÃ‚Â¢ÃƒÆ’Ã‚Â¢ÃƒÂ¢Ã¢â‚¬Å¡Ã‚Â¬Ãƒâ€¦Ã‚Â¡ÃƒÆ’Ã¢â‚¬Å¡Ãƒâ€šÃ‚Â¬ÃƒÆ’Ã†â€™Ãƒâ€šÃ‚Â¢ÃƒÆ’Ã‚Â¢ÃƒÂ¢Ã¢â‚¬Å¡Ã‚Â¬Ãƒâ€¦Ã‚Â¾ÃƒÆ’Ã¢â‚¬Å¡Ãƒâ€šÃ‚Â¢ÃƒÆ’Ã†â€™Ãƒâ€ Ã¢â‚¬â„¢ÃƒÆ’Ã¢â‚¬Â ÃƒÂ¢Ã¢â€šÂ¬Ã¢â€žÂ¢ÃƒÆ’Ã†â€™ÃƒÂ¢Ã¢â€šÂ¬Ã‚Â ÃƒÆ’Ã‚Â¢ÃƒÂ¢Ã¢â‚¬Å¡Ã‚Â¬ÃƒÂ¢Ã¢â‚¬Å¾Ã‚Â¢ÃƒÆ’Ã†â€™Ãƒâ€ Ã¢â‚¬â„¢ÃƒÆ’Ã¢â‚¬Å¡Ãƒâ€šÃ‚Â¢ÃƒÆ’Ã†â€™Ãƒâ€šÃ‚Â¢ÃƒÆ’Ã‚Â¢ÃƒÂ¢Ã¢â‚¬Å¡Ã‚Â¬Ãƒâ€¦Ã‚Â¡ÃƒÆ’Ã¢â‚¬Å¡Ãƒâ€šÃ‚Â¬ÃƒÆ’Ã†â€™ÃƒÂ¢Ã¢â€šÂ¬Ã‚Â¦ÃƒÆ’Ã¢â‚¬Å¡Ãƒâ€šÃ‚Â¡ÃƒÆ’Ã†â€™Ãƒâ€ Ã¢â‚¬â„¢ÃƒÆ’Ã¢â‚¬Â ÃƒÂ¢Ã¢â€šÂ¬Ã¢â€žÂ¢ÃƒÆ’Ã†â€™Ãƒâ€šÃ‚Â¢ÃƒÆ’Ã‚Â¢ÃƒÂ¢Ã¢â€šÂ¬Ã…Â¡Ãƒâ€šÃ‚Â¬ÃƒÆ’Ã¢â‚¬Â¦Ãƒâ€šÃ‚Â¡ÃƒÆ’Ã†â€™Ãƒâ€ Ã¢â‚¬â„¢ÃƒÆ’Ã‚Â¢ÃƒÂ¢Ã¢â‚¬Å¡Ã‚Â¬Ãƒâ€¦Ã‚Â¡ÃƒÆ’Ã†â€™ÃƒÂ¢Ã¢â€šÂ¬Ã…Â¡ÃƒÆ’Ã¢â‚¬Å¡Ãƒâ€šÃ‚Â¢ÃƒÆ’Ã†â€™Ãƒâ€ Ã¢â‚¬â„¢ÃƒÆ’Ã¢â‚¬Â ÃƒÂ¢Ã¢â€šÂ¬Ã¢â€žÂ¢ÃƒÆ’Ã†â€™ÃƒÂ¢Ã¢â€šÂ¬Ã‚Â ÃƒÆ’Ã‚Â¢ÃƒÂ¢Ã¢â‚¬Å¡Ã‚Â¬ÃƒÂ¢Ã¢â‚¬Å¾Ã‚Â¢ÃƒÆ’Ã†â€™Ãƒâ€ Ã¢â‚¬â„¢ÃƒÆ’Ã‚Â¢ÃƒÂ¢Ã¢â‚¬Å¡Ã‚Â¬Ãƒâ€šÃ‚Â ÃƒÆ’Ã†â€™Ãƒâ€šÃ‚Â¢ÃƒÆ’Ã‚Â¢ÃƒÂ¢Ã¢â€šÂ¬Ã…Â¡Ãƒâ€šÃ‚Â¬ÃƒÆ’Ã‚Â¢ÃƒÂ¢Ã¢â€šÂ¬Ã…Â¾Ãƒâ€šÃ‚Â¢ÃƒÆ’Ã†â€™Ãƒâ€ Ã¢â‚¬â„¢ÃƒÆ’Ã¢â‚¬Â ÃƒÂ¢Ã¢â€šÂ¬Ã¢â€žÂ¢ÃƒÆ’Ã†â€™Ãƒâ€šÃ‚Â¢ÃƒÆ’Ã‚Â¢ÃƒÂ¢Ã¢â€šÂ¬Ã…Â¡Ãƒâ€šÃ‚Â¬ÃƒÆ’Ã¢â‚¬Â¦Ãƒâ€šÃ‚Â¡ÃƒÆ’Ã†â€™Ãƒâ€ Ã¢â‚¬â„¢ÃƒÆ’Ã‚Â¢ÃƒÂ¢Ã¢â‚¬Å¡Ã‚Â¬Ãƒâ€¦Ã‚Â¡ÃƒÆ’Ã†â€™ÃƒÂ¢Ã¢â€šÂ¬Ã…Â¡ÃƒÆ’Ã¢â‚¬Å¡Ãƒâ€šÃ‚Â¢ÃƒÆ’Ã†â€™Ãƒâ€ Ã¢â‚¬â„¢ÃƒÆ’Ã¢â‚¬Â ÃƒÂ¢Ã¢â€šÂ¬Ã¢â€žÂ¢ÃƒÆ’Ã†â€™ÃƒÂ¢Ã¢â€šÂ¬Ã‚Â ÃƒÆ’Ã‚Â¢ÃƒÂ¢Ã¢â‚¬Å¡Ã‚Â¬ÃƒÂ¢Ã¢â‚¬Å¾Ã‚Â¢ÃƒÆ’Ã†â€™Ãƒâ€ Ã¢â‚¬â„¢ÃƒÆ’Ã‚Â¢ÃƒÂ¢Ã¢â‚¬Å¡Ã‚Â¬Ãƒâ€¦Ã‚Â¡ÃƒÆ’Ã†â€™ÃƒÂ¢Ã¢â€šÂ¬Ã…Â¡ÃƒÆ’Ã¢â‚¬Å¡Ãƒâ€šÃ‚Â¢ÃƒÆ’Ã†â€™Ãƒâ€ Ã¢â‚¬â„¢ÃƒÆ’Ã¢â‚¬Â ÃƒÂ¢Ã¢â€šÂ¬Ã¢â€žÂ¢ÃƒÆ’Ã†â€™ÃƒÂ¢Ã¢â€šÂ¬Ã…Â¡ÃƒÆ’Ã¢â‚¬Å¡Ãƒâ€šÃ‚Â¢ÃƒÆ’Ã†â€™Ãƒâ€ Ã¢â‚¬â„¢ÃƒÆ’Ã¢â‚¬Å¡Ãƒâ€šÃ‚Â¢ÃƒÆ’Ã†â€™Ãƒâ€šÃ‚Â¢ÃƒÆ’Ã‚Â¢ÃƒÂ¢Ã¢â‚¬Å¡Ã‚Â¬Ãƒâ€¦Ã‚Â¡ÃƒÆ’Ã¢â‚¬Å¡Ãƒâ€šÃ‚Â¬ÃƒÆ’Ã†â€™ÃƒÂ¢Ã¢â€šÂ¬Ã‚Â¦ÃƒÆ’Ã¢â‚¬Å¡Ãƒâ€šÃ‚Â¡ÃƒÆ’Ã†â€™Ãƒâ€ Ã¢â‚¬â„¢ÃƒÆ’Ã‚Â¢ÃƒÂ¢Ã¢â‚¬Å¡Ã‚Â¬Ãƒâ€¦Ã‚Â¡ÃƒÆ’Ã†â€™ÃƒÂ¢Ã¢â€šÂ¬Ã…Â¡ÃƒÆ’Ã¢â‚¬Å¡Ãƒâ€šÃ‚Â¬ÃƒÆ’Ã†â€™Ãƒâ€ Ã¢â‚¬â„¢ÃƒÆ’Ã¢â‚¬Â ÃƒÂ¢Ã¢â€šÂ¬Ã¢â€žÂ¢ÃƒÆ’Ã†â€™Ãƒâ€šÃ‚Â¢ÃƒÆ’Ã‚Â¢ÃƒÂ¢Ã¢â€šÂ¬Ã…Â¡Ãƒâ€šÃ‚Â¬ÃƒÆ’Ã¢â‚¬Å¡Ãƒâ€šÃ‚Â¦ÃƒÆ’Ã†â€™Ãƒâ€ Ã¢â‚¬â„¢ÃƒÆ’Ã‚Â¢ÃƒÂ¢Ã¢â‚¬Å¡Ã‚Â¬Ãƒâ€¦Ã‚Â¡ÃƒÆ’Ã†â€™ÃƒÂ¢Ã¢â€šÂ¬Ã…Â¡ÃƒÆ’Ã¢â‚¬Å¡Ãƒâ€šÃ‚Â¡ÃƒÆ’Ã†â€™Ãƒâ€ Ã¢â‚¬â„¢ÃƒÆ’Ã¢â‚¬Â ÃƒÂ¢Ã¢â€šÂ¬Ã¢â€žÂ¢ÃƒÆ’Ã†â€™ÃƒÂ¢Ã¢â€šÂ¬Ã‚Â ÃƒÆ’Ã‚Â¢ÃƒÂ¢Ã¢â‚¬Å¡Ã‚Â¬ÃƒÂ¢Ã¢â‚¬Å¾Ã‚Â¢ÃƒÆ’Ã†â€™Ãƒâ€ Ã¢â‚¬â„¢ÃƒÆ’Ã¢â‚¬Å¡Ãƒâ€šÃ‚Â¢ÃƒÆ’Ã†â€™Ãƒâ€šÃ‚Â¢ÃƒÆ’Ã‚Â¢ÃƒÂ¢Ã¢â‚¬Å¡Ã‚Â¬Ãƒâ€¦Ã‚Â¡ÃƒÆ’Ã¢â‚¬Å¡Ãƒâ€šÃ‚Â¬ÃƒÆ’Ã†â€™ÃƒÂ¢Ã¢â€šÂ¬Ã‚Â¦ÃƒÆ’Ã¢â‚¬Å¡Ãƒâ€šÃ‚Â¡ÃƒÆ’Ã†â€™Ãƒâ€ Ã¢â‚¬â„¢ÃƒÆ’Ã¢â‚¬Â ÃƒÂ¢Ã¢â€šÂ¬Ã¢â€žÂ¢ÃƒÆ’Ã†â€™Ãƒâ€šÃ‚Â¢ÃƒÆ’Ã‚Â¢ÃƒÂ¢Ã¢â€šÂ¬Ã…Â¡Ãƒâ€šÃ‚Â¬ÃƒÆ’Ã¢â‚¬Â¦Ãƒâ€šÃ‚Â¡ÃƒÆ’Ã†â€™Ãƒâ€ Ã¢â‚¬â„¢ÃƒÆ’Ã‚Â¢ÃƒÂ¢Ã¢â‚¬Å¡Ã‚Â¬Ãƒâ€¦Ã‚Â¡ÃƒÆ’Ã†â€™ÃƒÂ¢Ã¢â€šÂ¬Ã…Â¡ÃƒÆ’Ã¢â‚¬Å¡Ãƒâ€šÃ‚Â¬ÃƒÆ’Ã†â€™Ãƒâ€ Ã¢â‚¬â„¢ÃƒÆ’Ã¢â‚¬Â ÃƒÂ¢Ã¢â€šÂ¬Ã¢â€žÂ¢ÃƒÆ’Ã†â€™ÃƒÂ¢Ã¢â€šÂ¬Ã‚Â ÃƒÆ’Ã‚Â¢ÃƒÂ¢Ã¢â‚¬Å¡Ã‚Â¬ÃƒÂ¢Ã¢â‚¬Å¾Ã‚Â¢ÃƒÆ’Ã†â€™Ãƒâ€ Ã¢â‚¬â„¢ÃƒÆ’Ã‚Â¢ÃƒÂ¢Ã¢â‚¬Å¡Ã‚Â¬Ãƒâ€šÃ‚Â ÃƒÆ’Ã†â€™Ãƒâ€šÃ‚Â¢ÃƒÆ’Ã‚Â¢ÃƒÂ¢Ã¢â€šÂ¬Ã…Â¡Ãƒâ€šÃ‚Â¬ÃƒÆ’Ã‚Â¢ÃƒÂ¢Ã¢â€šÂ¬Ã…Â¾Ãƒâ€šÃ‚Â¢ÃƒÆ’Ã†â€™Ãƒâ€ Ã¢â‚¬â„¢ÃƒÆ’Ã¢â‚¬Â ÃƒÂ¢Ã¢â€šÂ¬Ã¢â€žÂ¢ÃƒÆ’Ã†â€™Ãƒâ€šÃ‚Â¢ÃƒÆ’Ã‚Â¢ÃƒÂ¢Ã¢â€šÂ¬Ã…Â¡Ãƒâ€šÃ‚Â¬ÃƒÆ’Ã¢â‚¬Â¦Ãƒâ€šÃ‚Â¡ÃƒÆ’Ã†â€™Ãƒâ€ Ã¢â‚¬â„¢ÃƒÆ’Ã‚Â¢ÃƒÂ¢Ã¢â‚¬Å¡Ã‚Â¬Ãƒâ€¦Ã‚Â¡ÃƒÆ’Ã†â€™ÃƒÂ¢Ã¢â€šÂ¬Ã…Â¡ÃƒÆ’Ã¢â‚¬Å¡Ãƒâ€šÃ‚Â¢ÃƒÆ’Ã†â€™Ãƒâ€ Ã¢â‚¬â„¢ÃƒÆ’Ã¢â‚¬Â ÃƒÂ¢Ã¢â€šÂ¬Ã¢â€žÂ¢ÃƒÆ’Ã†â€™ÃƒÂ¢Ã¢â€šÂ¬Ã‚Â ÃƒÆ’Ã‚Â¢ÃƒÂ¢Ã¢â‚¬Å¡Ã‚Â¬ÃƒÂ¢Ã¢â‚¬Å¾Ã‚Â¢ÃƒÆ’Ã†â€™Ãƒâ€ Ã¢â‚¬â„¢ÃƒÆ’Ã‚Â¢ÃƒÂ¢Ã¢â‚¬Å¡Ã‚Â¬Ãƒâ€¦Ã‚Â¡ÃƒÆ’Ã†â€™ÃƒÂ¢Ã¢â€šÂ¬Ã…Â¡ÃƒÆ’Ã¢â‚¬Å¡Ãƒâ€šÃ‚Â¢ÃƒÆ’Ã†â€™Ãƒâ€ Ã¢â‚¬â„¢ÃƒÆ’Ã¢â‚¬Â ÃƒÂ¢Ã¢â€šÂ¬Ã¢â€žÂ¢ÃƒÆ’Ã†â€™ÃƒÂ¢Ã¢â€šÂ¬Ã…Â¡ÃƒÆ’Ã¢â‚¬Å¡Ãƒâ€šÃ‚Â¢ÃƒÆ’Ã†â€™Ãƒâ€ Ã¢â‚¬â„¢ÃƒÆ’Ã¢â‚¬Å¡Ãƒâ€šÃ‚Â¢ÃƒÆ’Ã†â€™Ãƒâ€šÃ‚Â¢ÃƒÆ’Ã‚Â¢ÃƒÂ¢Ã¢â€šÂ¬Ã…Â¡Ãƒâ€šÃ‚Â¬ÃƒÆ’Ã¢â‚¬Â¦Ãƒâ€šÃ‚Â¡ÃƒÆ’Ã†â€™ÃƒÂ¢Ã¢â€šÂ¬Ã…Â¡ÃƒÆ’Ã¢â‚¬Å¡Ãƒâ€šÃ‚Â¬ÃƒÆ’Ã†â€™Ãƒâ€ Ã¢â‚¬â„¢ÃƒÆ’Ã‚Â¢ÃƒÂ¢Ã¢â‚¬Å¡Ã‚Â¬Ãƒâ€šÃ‚Â¦ÃƒÆ’Ã†â€™ÃƒÂ¢Ã¢â€šÂ¬Ã…Â¡ÃƒÆ’Ã¢â‚¬Å¡Ãƒâ€šÃ‚Â¡ÃƒÆ’Ã†â€™Ãƒâ€ Ã¢â‚¬â„¢ÃƒÆ’Ã¢â‚¬Â ÃƒÂ¢Ã¢â€šÂ¬Ã¢â€žÂ¢ÃƒÆ’Ã†â€™Ãƒâ€šÃ‚Â¢ÃƒÆ’Ã‚Â¢ÃƒÂ¢Ã¢â€šÂ¬Ã…Â¡Ãƒâ€šÃ‚Â¬ÃƒÆ’Ã¢â‚¬Â¦Ãƒâ€šÃ‚Â¡ÃƒÆ’Ã†â€™Ãƒâ€ Ã¢â‚¬â„¢ÃƒÆ’Ã‚Â¢ÃƒÂ¢Ã¢â‚¬Å¡Ã‚Â¬Ãƒâ€¦Ã‚Â¡ÃƒÆ’Ã†â€™ÃƒÂ¢Ã¢â€šÂ¬Ã…Â¡ÃƒÆ’Ã¢â‚¬Å¡Ãƒâ€šÃ‚Â¬ÃƒÆ’Ã†â€™Ãƒâ€ Ã¢â‚¬â„¢ÃƒÆ’Ã¢â‚¬Â ÃƒÂ¢Ã¢â€šÂ¬Ã¢â€žÂ¢ÃƒÆ’Ã†â€™ÃƒÂ¢Ã¢â€šÂ¬Ã‚Â ÃƒÆ’Ã‚Â¢ÃƒÂ¢Ã¢â‚¬Å¡Ã‚Â¬ÃƒÂ¢Ã¢â‚¬Å¾Ã‚Â¢ÃƒÆ’Ã†â€™Ãƒâ€ Ã¢â‚¬â„¢ÃƒÆ’Ã¢â‚¬Å¡Ãƒâ€šÃ‚Â¢ÃƒÆ’Ã†â€™Ãƒâ€šÃ‚Â¢ÃƒÆ’Ã‚Â¢ÃƒÂ¢Ã¢â‚¬Å¡Ã‚Â¬Ãƒâ€¦Ã‚Â¡ÃƒÆ’Ã¢â‚¬Å¡Ãƒâ€šÃ‚Â¬ÃƒÆ’Ã†â€™ÃƒÂ¢Ã¢â€šÂ¬Ã…Â¡ÃƒÆ’Ã¢â‚¬Å¡Ãƒâ€šÃ‚Â¦ÃƒÆ’Ã†â€™Ãƒâ€ Ã¢â‚¬â„¢ÃƒÆ’Ã¢â‚¬Â ÃƒÂ¢Ã¢â€šÂ¬Ã¢â€žÂ¢ÃƒÆ’Ã†â€™ÃƒÂ¢Ã¢â€šÂ¬Ã…Â¡ÃƒÆ’Ã¢â‚¬Å¡Ãƒâ€šÃ‚Â¢ÃƒÆ’Ã†â€™Ãƒâ€ Ã¢â‚¬â„¢ÃƒÆ’Ã¢â‚¬Å¡Ãƒâ€šÃ‚Â¢ÃƒÆ’Ã†â€™Ãƒâ€šÃ‚Â¢ÃƒÆ’Ã‚Â¢ÃƒÂ¢Ã¢â€šÂ¬Ã…Â¡Ãƒâ€šÃ‚Â¬ÃƒÆ’Ã¢â‚¬Â¦Ãƒâ€šÃ‚Â¡ÃƒÆ’Ã†â€™ÃƒÂ¢Ã¢â€šÂ¬Ã…Â¡ÃƒÆ’Ã¢â‚¬Å¡Ãƒâ€šÃ‚Â¬ÃƒÆ’Ã†â€™Ãƒâ€ Ã¢â‚¬â„¢ÃƒÆ’Ã‚Â¢ÃƒÂ¢Ã¢â‚¬Å¡Ã‚Â¬Ãƒâ€šÃ‚Â¦ÃƒÆ’Ã†â€™Ãƒâ€šÃ‚Â¢ÃƒÆ’Ã‚Â¢ÃƒÂ¢Ã¢â€šÂ¬Ã…Â¡Ãƒâ€šÃ‚Â¬ÃƒÆ’Ã¢â‚¬Â¦ÃƒÂ¢Ã¢â€šÂ¬Ã…â€œ3), TDS levels increased in both systems, with the Monoculture treatment showing slightly higher values (around 18.6 ppt) compared to the IMTA system (approximately 18.1 ppt).</w:t>
+        <w:t>The line graph illustrates the weekly changes in Total Dissolved Solids (TDS), measured in parts per thousand (ppt), for Integrated Multi-Trophic Aquaculture (IMTA) and Monoculture treatments over a seven-week period. At the beginning of the study (Week 1), both treatments recorded identical TDS levels of approximately 16.5 ppt. During the early phase (Weeks 2ÃƒÆ’Ã†â€™Ãƒâ€ Ã¢â‚¬â„¢ÃƒÆ’Ã¢â‚¬Â ÃƒÂ¢Ã¢â€šÂ¬Ã¢â€žÂ¢ÃƒÆ’Ã†â€™ÃƒÂ¢Ã¢â€šÂ¬Ã‚Â ÃƒÆ’Ã‚Â¢ÃƒÂ¢Ã¢â‚¬Å¡Ã‚Â¬ÃƒÂ¢Ã¢â‚¬Å¾Ã‚Â¢ÃƒÆ’Ã†â€™Ãƒâ€ Ã¢â‚¬â„¢ÃƒÆ’Ã‚Â¢ÃƒÂ¢Ã¢â‚¬Å¡Ã‚Â¬Ãƒâ€šÃ‚Â ÃƒÆ’Ã†â€™Ãƒâ€šÃ‚Â¢ÃƒÆ’Ã‚Â¢ÃƒÂ¢Ã¢â€šÂ¬Ã…Â¡Ãƒâ€šÃ‚Â¬ÃƒÆ’Ã‚Â¢ÃƒÂ¢Ã¢â€šÂ¬Ã…Â¾Ãƒâ€šÃ‚Â¢ÃƒÆ’Ã†â€™Ãƒâ€ Ã¢â‚¬â„¢ÃƒÆ’Ã¢â‚¬Â ÃƒÂ¢Ã¢â€šÂ¬Ã¢â€žÂ¢ÃƒÆ’Ã†â€™Ãƒâ€šÃ‚Â¢ÃƒÆ’Ã‚Â¢ÃƒÂ¢Ã¢â€šÂ¬Ã…Â¡Ãƒâ€šÃ‚Â¬ÃƒÆ’Ã¢â‚¬Å¡Ãƒâ€šÃ‚Â ÃƒÆ’Ã†â€™Ãƒâ€ Ã¢â‚¬â„¢ÃƒÆ’Ã¢â‚¬Å¡Ãƒâ€šÃ‚Â¢ÃƒÆ’Ã†â€™Ãƒâ€šÃ‚Â¢ÃƒÆ’Ã‚Â¢ÃƒÂ¢Ã¢â‚¬Å¡Ã‚Â¬Ãƒâ€¦Ã‚Â¡ÃƒÆ’Ã¢â‚¬Å¡Ãƒâ€šÃ‚Â¬ÃƒÆ’Ã†â€™Ãƒâ€šÃ‚Â¢ÃƒÆ’Ã‚Â¢ÃƒÂ¢Ã¢â‚¬Å¡Ã‚Â¬Ãƒâ€¦Ã‚Â¾ÃƒÆ’Ã¢â‚¬Å¡Ãƒâ€šÃ‚Â¢ÃƒÆ’Ã†â€™Ãƒâ€ Ã¢â‚¬â„¢ÃƒÆ’Ã¢â‚¬Â ÃƒÂ¢Ã¢â€šÂ¬Ã¢â€žÂ¢ÃƒÆ’Ã†â€™ÃƒÂ¢Ã¢â€šÂ¬Ã‚Â ÃƒÆ’Ã‚Â¢ÃƒÂ¢Ã¢â‚¬Å¡Ã‚Â¬ÃƒÂ¢Ã¢â‚¬Å¾Ã‚Â¢ÃƒÆ’Ã†â€™Ãƒâ€ Ã¢â‚¬â„¢ÃƒÆ’Ã¢â‚¬Å¡Ãƒâ€šÃ‚Â¢ÃƒÆ’Ã†â€™Ãƒâ€šÃ‚Â¢ÃƒÆ’Ã‚Â¢ÃƒÂ¢Ã¢â‚¬Å¡Ã‚Â¬Ãƒâ€¦Ã‚Â¡ÃƒÆ’Ã¢â‚¬Å¡Ãƒâ€šÃ‚Â¬ÃƒÆ’Ã†â€™ÃƒÂ¢Ã¢â€šÂ¬Ã…Â¡ÃƒÆ’Ã¢â‚¬Å¡Ãƒâ€šÃ‚Â ÃƒÆ’Ã†â€™Ãƒâ€ Ã¢â‚¬â„¢ÃƒÆ’Ã¢â‚¬Â ÃƒÂ¢Ã¢â€šÂ¬Ã¢â€žÂ¢ÃƒÆ’Ã†â€™ÃƒÂ¢Ã¢â€šÂ¬Ã…Â¡ÃƒÆ’Ã¢â‚¬Å¡Ãƒâ€šÃ‚Â¢ÃƒÆ’Ã†â€™Ãƒâ€ Ã¢â‚¬â„¢ÃƒÆ’Ã¢â‚¬Å¡Ãƒâ€šÃ‚Â¢ÃƒÆ’Ã†â€™Ãƒâ€šÃ‚Â¢ÃƒÆ’Ã‚Â¢ÃƒÂ¢Ã¢â€šÂ¬Ã…Â¡Ãƒâ€šÃ‚Â¬ÃƒÆ’Ã¢â‚¬Â¦Ãƒâ€šÃ‚Â¡ÃƒÆ’Ã†â€™ÃƒÂ¢Ã¢â€šÂ¬Ã…Â¡ÃƒÆ’Ã¢â‚¬Å¡Ãƒâ€šÃ‚Â¬ÃƒÆ’Ã†â€™Ãƒâ€ Ã¢â‚¬â„¢ÃƒÆ’Ã¢â‚¬Å¡Ãƒâ€šÃ‚Â¢ÃƒÆ’Ã†â€™Ãƒâ€šÃ‚Â¢ÃƒÆ’Ã‚Â¢ÃƒÂ¢Ã¢â€šÂ¬Ã…Â¡Ãƒâ€šÃ‚Â¬ÃƒÆ’Ã¢â‚¬Â¦Ãƒâ€šÃ‚Â¾ÃƒÆ’Ã†â€™ÃƒÂ¢Ã¢â€šÂ¬Ã…Â¡ÃƒÆ’Ã¢â‚¬Å¡Ãƒâ€šÃ‚Â¢ÃƒÆ’Ã†â€™Ãƒâ€ Ã¢â‚¬â„¢ÃƒÆ’Ã¢â‚¬Â ÃƒÂ¢Ã¢â€šÂ¬Ã¢â€žÂ¢ÃƒÆ’Ã†â€™ÃƒÂ¢Ã¢â€šÂ¬Ã‚Â ÃƒÆ’Ã‚Â¢ÃƒÂ¢Ã¢â‚¬Å¡Ã‚Â¬ÃƒÂ¢Ã¢â‚¬Å¾Ã‚Â¢ÃƒÆ’Ã†â€™Ãƒâ€ Ã¢â‚¬â„¢ÃƒÆ’Ã‚Â¢ÃƒÂ¢Ã¢â‚¬Å¡Ã‚Â¬Ãƒâ€šÃ‚Â ÃƒÆ’Ã†â€™Ãƒâ€šÃ‚Â¢ÃƒÆ’Ã‚Â¢ÃƒÂ¢Ã¢â€šÂ¬Ã…Â¡Ãƒâ€šÃ‚Â¬ÃƒÆ’Ã‚Â¢ÃƒÂ¢Ã¢â€šÂ¬Ã…Â¾Ãƒâ€šÃ‚Â¢ÃƒÆ’Ã†â€™Ãƒâ€ Ã¢â‚¬â„¢ÃƒÆ’Ã¢â‚¬Â ÃƒÂ¢Ã¢â€šÂ¬Ã¢â€žÂ¢ÃƒÆ’Ã†â€™ÃƒÂ¢Ã¢â€šÂ¬Ã…Â¡ÃƒÆ’Ã¢â‚¬Å¡Ãƒâ€šÃ‚Â¢ÃƒÆ’Ã†â€™Ãƒâ€ Ã¢â‚¬â„¢ÃƒÆ’Ã¢â‚¬Å¡Ãƒâ€šÃ‚Â¢ÃƒÆ’Ã†â€™Ãƒâ€šÃ‚Â¢ÃƒÆ’Ã‚Â¢ÃƒÂ¢Ã¢â€šÂ¬Ã…Â¡Ãƒâ€šÃ‚Â¬ÃƒÆ’Ã¢â‚¬Â¦Ãƒâ€šÃ‚Â¡ÃƒÆ’Ã†â€™ÃƒÂ¢Ã¢â€šÂ¬Ã…Â¡ÃƒÆ’Ã¢â‚¬Å¡Ãƒâ€šÃ‚Â¬ÃƒÆ’Ã†â€™Ãƒâ€ Ã¢â‚¬â„¢ÃƒÆ’Ã‚Â¢ÃƒÂ¢Ã¢â‚¬Å¡Ã‚Â¬Ãƒâ€šÃ‚Â¦ÃƒÆ’Ã†â€™ÃƒÂ¢Ã¢â€šÂ¬Ã…Â¡ÃƒÆ’Ã¢â‚¬Å¡Ãƒâ€šÃ‚Â¡ÃƒÆ’Ã†â€™Ãƒâ€ Ã¢â‚¬â„¢ÃƒÆ’Ã¢â‚¬Â ÃƒÂ¢Ã¢â€šÂ¬Ã¢â€žÂ¢ÃƒÆ’Ã†â€™ÃƒÂ¢Ã¢â€šÂ¬Ã‚Â ÃƒÆ’Ã‚Â¢ÃƒÂ¢Ã¢â‚¬Å¡Ã‚Â¬ÃƒÂ¢Ã¢â‚¬Å¾Ã‚Â¢ÃƒÆ’Ã†â€™Ãƒâ€ Ã¢â‚¬â„¢ÃƒÆ’Ã¢â‚¬Å¡Ãƒâ€šÃ‚Â¢ÃƒÆ’Ã†â€™Ãƒâ€šÃ‚Â¢ÃƒÆ’Ã‚Â¢ÃƒÂ¢Ã¢â‚¬Å¡Ã‚Â¬Ãƒâ€¦Ã‚Â¡ÃƒÆ’Ã¢â‚¬Å¡Ãƒâ€šÃ‚Â¬ÃƒÆ’Ã†â€™ÃƒÂ¢Ã¢â€šÂ¬Ã‚Â¦ÃƒÆ’Ã¢â‚¬Å¡Ãƒâ€šÃ‚Â¡ÃƒÆ’Ã†â€™Ãƒâ€ Ã¢â‚¬â„¢ÃƒÆ’Ã¢â‚¬Â ÃƒÂ¢Ã¢â€šÂ¬Ã¢â€žÂ¢ÃƒÆ’Ã†â€™Ãƒâ€šÃ‚Â¢ÃƒÆ’Ã‚Â¢ÃƒÂ¢Ã¢â€šÂ¬Ã…Â¡Ãƒâ€šÃ‚Â¬ÃƒÆ’Ã¢â‚¬Â¦Ãƒâ€šÃ‚Â¡ÃƒÆ’Ã†â€™Ãƒâ€ Ã¢â‚¬â„¢ÃƒÆ’Ã‚Â¢ÃƒÂ¢Ã¢â‚¬Å¡Ã‚Â¬Ãƒâ€¦Ã‚Â¡ÃƒÆ’Ã†â€™ÃƒÂ¢Ã¢â€šÂ¬Ã…Â¡ÃƒÆ’Ã¢â‚¬Å¡Ãƒâ€šÃ‚Â¢ÃƒÆ’Ã†â€™Ãƒâ€ Ã¢â‚¬â„¢ÃƒÆ’Ã¢â‚¬Â ÃƒÂ¢Ã¢â€šÂ¬Ã¢â€žÂ¢ÃƒÆ’Ã†â€™ÃƒÂ¢Ã¢â€šÂ¬Ã‚Â ÃƒÆ’Ã‚Â¢ÃƒÂ¢Ã¢â‚¬Å¡Ã‚Â¬ÃƒÂ¢Ã¢â‚¬Å¾Ã‚Â¢ÃƒÆ’Ã†â€™Ãƒâ€ Ã¢â‚¬â„¢ÃƒÆ’Ã‚Â¢ÃƒÂ¢Ã¢â‚¬Å¡Ã‚Â¬Ãƒâ€šÃ‚Â ÃƒÆ’Ã†â€™Ãƒâ€šÃ‚Â¢ÃƒÆ’Ã‚Â¢ÃƒÂ¢Ã¢â€šÂ¬Ã…Â¡Ãƒâ€šÃ‚Â¬ÃƒÆ’Ã‚Â¢ÃƒÂ¢Ã¢â€šÂ¬Ã…Â¾Ãƒâ€šÃ‚Â¢ÃƒÆ’Ã†â€™Ãƒâ€ Ã¢â‚¬â„¢ÃƒÆ’Ã¢â‚¬Â ÃƒÂ¢Ã¢â€šÂ¬Ã¢â€žÂ¢ÃƒÆ’Ã†â€™Ãƒâ€šÃ‚Â¢ÃƒÆ’Ã‚Â¢ÃƒÂ¢Ã¢â€šÂ¬Ã…Â¡Ãƒâ€šÃ‚Â¬ÃƒÆ’Ã¢â‚¬Å¡Ãƒâ€šÃ‚Â ÃƒÆ’Ã†â€™Ãƒâ€ Ã¢â‚¬â„¢ÃƒÆ’Ã¢â‚¬Å¡Ãƒâ€šÃ‚Â¢ÃƒÆ’Ã†â€™Ãƒâ€šÃ‚Â¢ÃƒÆ’Ã‚Â¢ÃƒÂ¢Ã¢â‚¬Å¡Ã‚Â¬Ãƒâ€¦Ã‚Â¡ÃƒÆ’Ã¢â‚¬Å¡Ãƒâ€šÃ‚Â¬ÃƒÆ’Ã†â€™Ãƒâ€šÃ‚Â¢ÃƒÆ’Ã‚Â¢ÃƒÂ¢Ã¢â‚¬Å¡Ã‚Â¬Ãƒâ€¦Ã‚Â¾ÃƒÆ’Ã¢â‚¬Å¡Ãƒâ€šÃ‚Â¢ÃƒÆ’Ã†â€™Ãƒâ€ Ã¢â‚¬â„¢ÃƒÆ’Ã¢â‚¬Â ÃƒÂ¢Ã¢â€šÂ¬Ã¢â€žÂ¢ÃƒÆ’Ã†â€™ÃƒÂ¢Ã¢â€šÂ¬Ã‚Â ÃƒÆ’Ã‚Â¢ÃƒÂ¢Ã¢â‚¬Å¡Ã‚Â¬ÃƒÂ¢Ã¢â‚¬Å¾Ã‚Â¢ÃƒÆ’Ã†â€™Ãƒâ€ Ã¢â‚¬â„¢ÃƒÆ’Ã¢â‚¬Å¡Ãƒâ€šÃ‚Â¢ÃƒÆ’Ã†â€™Ãƒâ€šÃ‚Â¢ÃƒÆ’Ã‚Â¢ÃƒÂ¢Ã¢â‚¬Å¡Ã‚Â¬Ãƒâ€¦Ã‚Â¡ÃƒÆ’Ã¢â‚¬Å¡Ãƒâ€šÃ‚Â¬ÃƒÆ’Ã†â€™ÃƒÂ¢Ã¢â€šÂ¬Ã‚Â¦ÃƒÆ’Ã¢â‚¬Å¡Ãƒâ€šÃ‚Â¡ÃƒÆ’Ã†â€™Ãƒâ€ Ã¢â‚¬â„¢ÃƒÆ’Ã¢â‚¬Â ÃƒÂ¢Ã¢â€šÂ¬Ã¢â€žÂ¢ÃƒÆ’Ã†â€™Ãƒâ€šÃ‚Â¢ÃƒÆ’Ã‚Â¢ÃƒÂ¢Ã¢â€šÂ¬Ã…Â¡Ãƒâ€šÃ‚Â¬ÃƒÆ’Ã¢â‚¬Â¦Ãƒâ€šÃ‚Â¡ÃƒÆ’Ã†â€™Ãƒâ€ Ã¢â‚¬â„¢ÃƒÆ’Ã‚Â¢ÃƒÂ¢Ã¢â‚¬Å¡Ã‚Â¬Ãƒâ€¦Ã‚Â¡ÃƒÆ’Ã†â€™ÃƒÂ¢Ã¢â€šÂ¬Ã…Â¡ÃƒÆ’Ã¢â‚¬Å¡Ãƒâ€šÃ‚Â¢ÃƒÆ’Ã†â€™Ãƒâ€ Ã¢â‚¬â„¢ÃƒÆ’Ã¢â‚¬Â ÃƒÂ¢Ã¢â€šÂ¬Ã¢â€žÂ¢ÃƒÆ’Ã†â€™ÃƒÂ¢Ã¢â€šÂ¬Ã‚Â ÃƒÆ’Ã‚Â¢ÃƒÂ¢Ã¢â‚¬Å¡Ã‚Â¬ÃƒÂ¢Ã¢â‚¬Å¾Ã‚Â¢ÃƒÆ’Ã†â€™Ãƒâ€ Ã¢â‚¬â„¢ÃƒÆ’Ã‚Â¢ÃƒÂ¢Ã¢â‚¬Å¡Ã‚Â¬Ãƒâ€šÃ‚Â ÃƒÆ’Ã†â€™Ãƒâ€šÃ‚Â¢ÃƒÆ’Ã‚Â¢ÃƒÂ¢Ã¢â€šÂ¬Ã…Â¡Ãƒâ€šÃ‚Â¬ÃƒÆ’Ã‚Â¢ÃƒÂ¢Ã¢â€šÂ¬Ã…Â¾Ãƒâ€šÃ‚Â¢ÃƒÆ’Ã†â€™Ãƒâ€ Ã¢â‚¬â„¢ÃƒÆ’Ã¢â‚¬Â ÃƒÂ¢Ã¢â€šÂ¬Ã¢â€žÂ¢ÃƒÆ’Ã†â€™Ãƒâ€šÃ‚Â¢ÃƒÆ’Ã‚Â¢ÃƒÂ¢Ã¢â€šÂ¬Ã…Â¡Ãƒâ€šÃ‚Â¬ÃƒÆ’Ã¢â‚¬Â¦Ãƒâ€šÃ‚Â¡ÃƒÆ’Ã†â€™Ãƒâ€ Ã¢â‚¬â„¢ÃƒÆ’Ã‚Â¢ÃƒÂ¢Ã¢â‚¬Å¡Ã‚Â¬Ãƒâ€¦Ã‚Â¡ÃƒÆ’Ã†â€™ÃƒÂ¢Ã¢â€šÂ¬Ã…Â¡ÃƒÆ’Ã¢â‚¬Å¡Ãƒâ€šÃ‚Â¢ÃƒÆ’Ã†â€™Ãƒâ€ Ã¢â‚¬â„¢ÃƒÆ’Ã¢â‚¬Â ÃƒÂ¢Ã¢â€šÂ¬Ã¢â€žÂ¢ÃƒÆ’Ã†â€™ÃƒÂ¢Ã¢â€šÂ¬Ã‚Â ÃƒÆ’Ã‚Â¢ÃƒÂ¢Ã¢â‚¬Å¡Ã‚Â¬ÃƒÂ¢Ã¢â‚¬Å¾Ã‚Â¢ÃƒÆ’Ã†â€™Ãƒâ€ Ã¢â‚¬â„¢ÃƒÆ’Ã‚Â¢ÃƒÂ¢Ã¢â‚¬Å¡Ã‚Â¬Ãƒâ€¦Ã‚Â¡ÃƒÆ’Ã†â€™ÃƒÂ¢Ã¢â€šÂ¬Ã…Â¡ÃƒÆ’Ã¢â‚¬Å¡Ãƒâ€šÃ‚Â¢ÃƒÆ’Ã†â€™Ãƒâ€ Ã¢â‚¬â„¢ÃƒÆ’Ã¢â‚¬Â ÃƒÂ¢Ã¢â€šÂ¬Ã¢â€žÂ¢ÃƒÆ’Ã†â€™ÃƒÂ¢Ã¢â€šÂ¬Ã…Â¡ÃƒÆ’Ã¢â‚¬Å¡Ãƒâ€šÃ‚Â¢ÃƒÆ’Ã†â€™Ãƒâ€ Ã¢â‚¬â„¢ÃƒÆ’Ã¢â‚¬Å¡Ãƒâ€šÃ‚Â¢ÃƒÆ’Ã†â€™Ãƒâ€šÃ‚Â¢ÃƒÆ’Ã‚Â¢ÃƒÂ¢Ã¢â€šÂ¬Ã…Â¡Ãƒâ€šÃ‚Â¬ÃƒÆ’Ã¢â‚¬Â¦Ãƒâ€šÃ‚Â¡ÃƒÆ’Ã†â€™ÃƒÂ¢Ã¢â€šÂ¬Ã…Â¡ÃƒÆ’Ã¢â‚¬Å¡Ãƒâ€šÃ‚Â¬ÃƒÆ’Ã†â€™Ãƒâ€ Ã¢â‚¬â„¢ÃƒÆ’Ã‚Â¢ÃƒÂ¢Ã¢â‚¬Å¡Ã‚Â¬Ãƒâ€šÃ‚Â¦ÃƒÆ’Ã†â€™ÃƒÂ¢Ã¢â€šÂ¬Ã…Â¡ÃƒÆ’Ã¢â‚¬Å¡Ãƒâ€šÃ‚Â¡ÃƒÆ’Ã†â€™Ãƒâ€ Ã¢â‚¬â„¢ÃƒÆ’Ã¢â‚¬Â ÃƒÂ¢Ã¢â€šÂ¬Ã¢â€žÂ¢ÃƒÆ’Ã†â€™Ãƒâ€šÃ‚Â¢ÃƒÆ’Ã‚Â¢ÃƒÂ¢Ã¢â€šÂ¬Ã…Â¡Ãƒâ€šÃ‚Â¬ÃƒÆ’Ã¢â‚¬Â¦Ãƒâ€šÃ‚Â¡ÃƒÆ’Ã†â€™Ãƒâ€ Ã¢â‚¬â„¢ÃƒÆ’Ã‚Â¢ÃƒÂ¢Ã¢â‚¬Å¡Ã‚Â¬Ãƒâ€¦Ã‚Â¡ÃƒÆ’Ã†â€™ÃƒÂ¢Ã¢â€šÂ¬Ã…Â¡ÃƒÆ’Ã¢â‚¬Å¡Ãƒâ€šÃ‚Â¬ÃƒÆ’Ã†â€™Ãƒâ€ Ã¢â‚¬â„¢ÃƒÆ’Ã¢â‚¬Â ÃƒÂ¢Ã¢â€šÂ¬Ã¢â€žÂ¢ÃƒÆ’Ã†â€™ÃƒÂ¢Ã¢â€šÂ¬Ã‚Â ÃƒÆ’Ã‚Â¢ÃƒÂ¢Ã¢â‚¬Å¡Ã‚Â¬ÃƒÂ¢Ã¢â‚¬Å¾Ã‚Â¢ÃƒÆ’Ã†â€™Ãƒâ€ Ã¢â‚¬â„¢ÃƒÆ’Ã¢â‚¬Å¡Ãƒâ€šÃ‚Â¢ÃƒÆ’Ã†â€™Ãƒâ€šÃ‚Â¢ÃƒÆ’Ã‚Â¢ÃƒÂ¢Ã¢â‚¬Å¡Ã‚Â¬Ãƒâ€¦Ã‚Â¡ÃƒÆ’Ã¢â‚¬Å¡Ãƒâ€šÃ‚Â¬ÃƒÆ’Ã†â€™ÃƒÂ¢Ã¢â€šÂ¬Ã…Â¡ÃƒÆ’Ã¢â‚¬Å¡Ãƒâ€šÃ‚Â¦ÃƒÆ’Ã†â€™Ãƒâ€ Ã¢â‚¬â„¢ÃƒÆ’Ã¢â‚¬Â ÃƒÂ¢Ã¢â€šÂ¬Ã¢â€žÂ¢ÃƒÆ’Ã†â€™Ãƒâ€šÃ‚Â¢ÃƒÆ’Ã‚Â¢ÃƒÂ¢Ã¢â€šÂ¬Ã…Â¡Ãƒâ€šÃ‚Â¬ÃƒÆ’Ã¢â‚¬Â¦Ãƒâ€šÃ‚Â¡ÃƒÆ’Ã†â€™Ãƒâ€ Ã¢â‚¬â„¢ÃƒÆ’Ã‚Â¢ÃƒÂ¢Ã¢â‚¬Å¡Ã‚Â¬Ãƒâ€¦Ã‚Â¡ÃƒÆ’Ã†â€™ÃƒÂ¢Ã¢â€šÂ¬Ã…Â¡ÃƒÆ’Ã¢â‚¬Å¡Ãƒâ€šÃ‚Â¡ÃƒÆ’Ã†â€™Ãƒâ€ Ã¢â‚¬â„¢ÃƒÆ’Ã¢â‚¬Â ÃƒÂ¢Ã¢â€šÂ¬Ã¢â€žÂ¢ÃƒÆ’Ã†â€™ÃƒÂ¢Ã¢â€šÂ¬Ã‚Â ÃƒÆ’Ã‚Â¢ÃƒÂ¢Ã¢â‚¬Å¡Ã‚Â¬ÃƒÂ¢Ã¢â‚¬Å¾Ã‚Â¢ÃƒÆ’Ã†â€™Ãƒâ€ Ã¢â‚¬â„¢ÃƒÆ’Ã‚Â¢ÃƒÂ¢Ã¢â‚¬Å¡Ã‚Â¬Ãƒâ€šÃ‚Â ÃƒÆ’Ã†â€™Ãƒâ€šÃ‚Â¢ÃƒÆ’Ã‚Â¢ÃƒÂ¢Ã¢â€šÂ¬Ã…Â¡Ãƒâ€šÃ‚Â¬ÃƒÆ’Ã‚Â¢ÃƒÂ¢Ã¢â€šÂ¬Ã…Â¾Ãƒâ€šÃ‚Â¢ÃƒÆ’Ã†â€™Ãƒâ€ Ã¢â‚¬â„¢ÃƒÆ’Ã¢â‚¬Â ÃƒÂ¢Ã¢â€šÂ¬Ã¢â€žÂ¢ÃƒÆ’Ã†â€™ÃƒÂ¢Ã¢â€šÂ¬Ã…Â¡ÃƒÆ’Ã¢â‚¬Å¡Ãƒâ€šÃ‚Â¢ÃƒÆ’Ã†â€™Ãƒâ€ Ã¢â‚¬â„¢ÃƒÆ’Ã¢â‚¬Å¡Ãƒâ€šÃ‚Â¢ÃƒÆ’Ã†â€™Ãƒâ€šÃ‚Â¢ÃƒÆ’Ã‚Â¢ÃƒÂ¢Ã¢â€šÂ¬Ã…Â¡Ãƒâ€šÃ‚Â¬ÃƒÆ’Ã¢â‚¬Â¦Ãƒâ€šÃ‚Â¡ÃƒÆ’Ã†â€™ÃƒÂ¢Ã¢â€šÂ¬Ã…Â¡ÃƒÆ’Ã¢â‚¬Å¡Ãƒâ€šÃ‚Â¬ÃƒÆ’Ã†â€™Ãƒâ€ Ã¢â‚¬â„¢ÃƒÆ’Ã‚Â¢ÃƒÂ¢Ã¢â‚¬Å¡Ã‚Â¬Ãƒâ€šÃ‚Â¦ÃƒÆ’Ã†â€™ÃƒÂ¢Ã¢â€šÂ¬Ã…Â¡ÃƒÆ’Ã¢â‚¬Å¡Ãƒâ€šÃ‚Â¡ÃƒÆ’Ã†â€™Ãƒâ€ Ã¢â‚¬â„¢ÃƒÆ’Ã¢â‚¬Â ÃƒÂ¢Ã¢â€šÂ¬Ã¢â€žÂ¢ÃƒÆ’Ã†â€™ÃƒÂ¢Ã¢â€šÂ¬Ã‚Â ÃƒÆ’Ã‚Â¢ÃƒÂ¢Ã¢â‚¬Å¡Ã‚Â¬ÃƒÂ¢Ã¢â‚¬Å¾Ã‚Â¢ÃƒÆ’Ã†â€™Ãƒâ€ Ã¢â‚¬â„¢ÃƒÆ’Ã¢â‚¬Å¡Ãƒâ€šÃ‚Â¢ÃƒÆ’Ã†â€™Ãƒâ€šÃ‚Â¢ÃƒÆ’Ã‚Â¢ÃƒÂ¢Ã¢â‚¬Å¡Ã‚Â¬Ãƒâ€¦Ã‚Â¡ÃƒÆ’Ã¢â‚¬Å¡Ãƒâ€šÃ‚Â¬ÃƒÆ’Ã†â€™ÃƒÂ¢Ã¢â€šÂ¬Ã‚Â¦ÃƒÆ’Ã¢â‚¬Å¡Ãƒâ€šÃ‚Â¡ÃƒÆ’Ã†â€™Ãƒâ€ Ã¢â‚¬â„¢ÃƒÆ’Ã¢â‚¬Â ÃƒÂ¢Ã¢â€šÂ¬Ã¢â€žÂ¢ÃƒÆ’Ã†â€™Ãƒâ€šÃ‚Â¢ÃƒÆ’Ã‚Â¢ÃƒÂ¢Ã¢â€šÂ¬Ã…Â¡Ãƒâ€šÃ‚Â¬ÃƒÆ’Ã¢â‚¬Â¦Ãƒâ€šÃ‚Â¡ÃƒÆ’Ã†â€™Ãƒâ€ Ã¢â‚¬â„¢ÃƒÆ’Ã‚Â¢ÃƒÂ¢Ã¢â‚¬Å¡Ã‚Â¬Ãƒâ€¦Ã‚Â¡ÃƒÆ’Ã†â€™ÃƒÂ¢Ã¢â€šÂ¬Ã…Â¡ÃƒÆ’Ã¢â‚¬Å¡Ãƒâ€šÃ‚Â¬ÃƒÆ’Ã†â€™Ãƒâ€ Ã¢â‚¬â„¢ÃƒÆ’Ã¢â‚¬Â ÃƒÂ¢Ã¢â€šÂ¬Ã¢â€žÂ¢ÃƒÆ’Ã†â€™ÃƒÂ¢Ã¢â€šÂ¬Ã‚Â ÃƒÆ’Ã‚Â¢ÃƒÂ¢Ã¢â‚¬Å¡Ã‚Â¬ÃƒÂ¢Ã¢â‚¬Å¾Ã‚Â¢ÃƒÆ’Ã†â€™Ãƒâ€ Ã¢â‚¬â„¢ÃƒÆ’Ã‚Â¢ÃƒÂ¢Ã¢â‚¬Å¡Ã‚Â¬Ãƒâ€šÃ‚Â ÃƒÆ’Ã†â€™Ãƒâ€šÃ‚Â¢ÃƒÆ’Ã‚Â¢ÃƒÂ¢Ã¢â€šÂ¬Ã…Â¡Ãƒâ€šÃ‚Â¬ÃƒÆ’Ã‚Â¢ÃƒÂ¢Ã¢â€šÂ¬Ã…Â¾Ãƒâ€šÃ‚Â¢ÃƒÆ’Ã†â€™Ãƒâ€ Ã¢â‚¬â„¢ÃƒÆ’Ã¢â‚¬Â ÃƒÂ¢Ã¢â€šÂ¬Ã¢â€žÂ¢ÃƒÆ’Ã†â€™Ãƒâ€šÃ‚Â¢ÃƒÆ’Ã‚Â¢ÃƒÂ¢Ã¢â€šÂ¬Ã…Â¡Ãƒâ€šÃ‚Â¬ÃƒÆ’Ã¢â‚¬Å¡Ãƒâ€šÃ‚Â ÃƒÆ’Ã†â€™Ãƒâ€ Ã¢â‚¬â„¢ÃƒÆ’Ã¢â‚¬Å¡Ãƒâ€šÃ‚Â¢ÃƒÆ’Ã†â€™Ãƒâ€šÃ‚Â¢ÃƒÆ’Ã‚Â¢ÃƒÂ¢Ã¢â‚¬Å¡Ã‚Â¬Ãƒâ€¦Ã‚Â¡ÃƒÆ’Ã¢â‚¬Å¡Ãƒâ€šÃ‚Â¬ÃƒÆ’Ã†â€™Ãƒâ€šÃ‚Â¢ÃƒÆ’Ã‚Â¢ÃƒÂ¢Ã¢â‚¬Å¡Ã‚Â¬Ãƒâ€¦Ã‚Â¾ÃƒÆ’Ã¢â‚¬Å¡Ãƒâ€šÃ‚Â¢ÃƒÆ’Ã†â€™Ãƒâ€ Ã¢â‚¬â„¢ÃƒÆ’Ã¢â‚¬Â ÃƒÂ¢Ã¢â€šÂ¬Ã¢â€žÂ¢ÃƒÆ’Ã†â€™ÃƒÂ¢Ã¢â€šÂ¬Ã‚Â ÃƒÆ’Ã‚Â¢ÃƒÂ¢Ã¢â‚¬Å¡Ã‚Â¬ÃƒÂ¢Ã¢â‚¬Å¾Ã‚Â¢ÃƒÆ’Ã†â€™Ãƒâ€ Ã¢â‚¬â„¢ÃƒÆ’Ã¢â‚¬Å¡Ãƒâ€šÃ‚Â¢ÃƒÆ’Ã†â€™Ãƒâ€šÃ‚Â¢ÃƒÆ’Ã‚Â¢ÃƒÂ¢Ã¢â‚¬Å¡Ã‚Â¬Ãƒâ€¦Ã‚Â¡ÃƒÆ’Ã¢â‚¬Å¡Ãƒâ€šÃ‚Â¬ÃƒÆ’Ã†â€™ÃƒÂ¢Ã¢â€šÂ¬Ã‚Â¦ÃƒÆ’Ã¢â‚¬Å¡Ãƒâ€šÃ‚Â¡ÃƒÆ’Ã†â€™Ãƒâ€ Ã¢â‚¬â„¢ÃƒÆ’Ã¢â‚¬Â ÃƒÂ¢Ã¢â€šÂ¬Ã¢â€žÂ¢ÃƒÆ’Ã†â€™Ãƒâ€šÃ‚Â¢ÃƒÆ’Ã‚Â¢ÃƒÂ¢Ã¢â€šÂ¬Ã…Â¡Ãƒâ€šÃ‚Â¬ÃƒÆ’Ã¢â‚¬Â¦Ãƒâ€šÃ‚Â¡ÃƒÆ’Ã†â€™Ãƒâ€ Ã¢â‚¬â„¢ÃƒÆ’Ã‚Â¢ÃƒÂ¢Ã¢â‚¬Å¡Ã‚Â¬Ãƒâ€¦Ã‚Â¡ÃƒÆ’Ã†â€™ÃƒÂ¢Ã¢â€šÂ¬Ã…Â¡ÃƒÆ’Ã¢â‚¬Å¡Ãƒâ€šÃ‚Â¢ÃƒÆ’Ã†â€™Ãƒâ€ Ã¢â‚¬â„¢ÃƒÆ’Ã¢â‚¬Â ÃƒÂ¢Ã¢â€šÂ¬Ã¢â€žÂ¢ÃƒÆ’Ã†â€™ÃƒÂ¢Ã¢â€šÂ¬Ã‚Â ÃƒÆ’Ã‚Â¢ÃƒÂ¢Ã¢â‚¬Å¡Ã‚Â¬ÃƒÂ¢Ã¢â‚¬Å¾Ã‚Â¢ÃƒÆ’Ã†â€™Ãƒâ€ Ã¢â‚¬â„¢ÃƒÆ’Ã‚Â¢ÃƒÂ¢Ã¢â‚¬Å¡Ã‚Â¬Ãƒâ€šÃ‚Â ÃƒÆ’Ã†â€™Ãƒâ€šÃ‚Â¢ÃƒÆ’Ã‚Â¢ÃƒÂ¢Ã¢â€šÂ¬Ã…Â¡Ãƒâ€šÃ‚Â¬ÃƒÆ’Ã‚Â¢ÃƒÂ¢Ã¢â€šÂ¬Ã…Â¾Ãƒâ€šÃ‚Â¢ÃƒÆ’Ã†â€™Ãƒâ€ Ã¢â‚¬â„¢ÃƒÆ’Ã¢â‚¬Â ÃƒÂ¢Ã¢â€šÂ¬Ã¢â€žÂ¢ÃƒÆ’Ã†â€™Ãƒâ€šÃ‚Â¢ÃƒÆ’Ã‚Â¢ÃƒÂ¢Ã¢â€šÂ¬Ã…Â¡Ãƒâ€šÃ‚Â¬ÃƒÆ’Ã¢â‚¬Â¦Ãƒâ€šÃ‚Â¡ÃƒÆ’Ã†â€™Ãƒâ€ Ã¢â‚¬â„¢ÃƒÆ’Ã‚Â¢ÃƒÂ¢Ã¢â‚¬Å¡Ã‚Â¬Ãƒâ€¦Ã‚Â¡ÃƒÆ’Ã†â€™ÃƒÂ¢Ã¢â€šÂ¬Ã…Â¡ÃƒÆ’Ã¢â‚¬Å¡Ãƒâ€šÃ‚Â¢ÃƒÆ’Ã†â€™Ãƒâ€ Ã¢â‚¬â„¢ÃƒÆ’Ã¢â‚¬Â ÃƒÂ¢Ã¢â€šÂ¬Ã¢â€žÂ¢ÃƒÆ’Ã†â€™ÃƒÂ¢Ã¢â€šÂ¬Ã‚Â ÃƒÆ’Ã‚Â¢ÃƒÂ¢Ã¢â‚¬Å¡Ã‚Â¬ÃƒÂ¢Ã¢â‚¬Å¾Ã‚Â¢ÃƒÆ’Ã†â€™Ãƒâ€ Ã¢â‚¬â„¢ÃƒÆ’Ã‚Â¢ÃƒÂ¢Ã¢â‚¬Å¡Ã‚Â¬Ãƒâ€¦Ã‚Â¡ÃƒÆ’Ã†â€™ÃƒÂ¢Ã¢â€šÂ¬Ã…Â¡ÃƒÆ’Ã¢â‚¬Å¡Ãƒâ€šÃ‚Â¢ÃƒÆ’Ã†â€™Ãƒâ€ Ã¢â‚¬â„¢ÃƒÆ’Ã¢â‚¬Â ÃƒÂ¢Ã¢â€šÂ¬Ã¢â€žÂ¢ÃƒÆ’Ã†â€™ÃƒÂ¢Ã¢â€šÂ¬Ã…Â¡ÃƒÆ’Ã¢â‚¬Å¡Ãƒâ€šÃ‚Â¢ÃƒÆ’Ã†â€™Ãƒâ€ Ã¢â‚¬â„¢ÃƒÆ’Ã¢â‚¬Å¡Ãƒâ€šÃ‚Â¢ÃƒÆ’Ã†â€™Ãƒâ€šÃ‚Â¢ÃƒÆ’Ã‚Â¢ÃƒÂ¢Ã¢â‚¬Å¡Ã‚Â¬Ãƒâ€¦Ã‚Â¡ÃƒÆ’Ã¢â‚¬Å¡Ãƒâ€šÃ‚Â¬ÃƒÆ’Ã†â€™ÃƒÂ¢Ã¢â€šÂ¬Ã‚Â¦ÃƒÆ’Ã¢â‚¬Å¡Ãƒâ€šÃ‚Â¡ÃƒÆ’Ã†â€™Ãƒâ€ Ã¢â‚¬â„¢ÃƒÆ’Ã‚Â¢ÃƒÂ¢Ã¢â‚¬Å¡Ã‚Â¬Ãƒâ€¦Ã‚Â¡ÃƒÆ’Ã†â€™ÃƒÂ¢Ã¢â€šÂ¬Ã…Â¡ÃƒÆ’Ã¢â‚¬Å¡Ãƒâ€šÃ‚Â¬ÃƒÆ’Ã†â€™Ãƒâ€ Ã¢â‚¬â„¢ÃƒÆ’Ã¢â‚¬Â ÃƒÂ¢Ã¢â€šÂ¬Ã¢â€žÂ¢ÃƒÆ’Ã†â€™Ãƒâ€šÃ‚Â¢ÃƒÆ’Ã‚Â¢ÃƒÂ¢Ã¢â€šÂ¬Ã…Â¡Ãƒâ€šÃ‚Â¬ÃƒÆ’Ã¢â‚¬Å¡Ãƒâ€šÃ‚Â¦ÃƒÆ’Ã†â€™Ãƒâ€ Ã¢â‚¬â„¢ÃƒÆ’Ã‚Â¢ÃƒÂ¢Ã¢â‚¬Å¡Ã‚Â¬Ãƒâ€¦Ã‚Â¡ÃƒÆ’Ã†â€™ÃƒÂ¢Ã¢â€šÂ¬Ã…Â¡ÃƒÆ’Ã¢â‚¬Å¡Ãƒâ€šÃ‚Â¡ÃƒÆ’Ã†â€™Ãƒâ€ Ã¢â‚¬â„¢ÃƒÆ’Ã¢â‚¬Â ÃƒÂ¢Ã¢â€šÂ¬Ã¢â€žÂ¢ÃƒÆ’Ã†â€™ÃƒÂ¢Ã¢â€šÂ¬Ã‚Â ÃƒÆ’Ã‚Â¢ÃƒÂ¢Ã¢â‚¬Å¡Ã‚Â¬ÃƒÂ¢Ã¢â‚¬Å¾Ã‚Â¢ÃƒÆ’Ã†â€™Ãƒâ€ Ã¢â‚¬â„¢ÃƒÆ’Ã¢â‚¬Å¡Ãƒâ€šÃ‚Â¢ÃƒÆ’Ã†â€™Ãƒâ€šÃ‚Â¢ÃƒÆ’Ã‚Â¢ÃƒÂ¢Ã¢â‚¬Å¡Ã‚Â¬Ãƒâ€¦Ã‚Â¡ÃƒÆ’Ã¢â‚¬Å¡Ãƒâ€šÃ‚Â¬ÃƒÆ’Ã†â€™ÃƒÂ¢Ã¢â€šÂ¬Ã‚Â¦ÃƒÆ’Ã¢â‚¬Å¡Ãƒâ€šÃ‚Â¡ÃƒÆ’Ã†â€™Ãƒâ€ Ã¢â‚¬â„¢ÃƒÆ’Ã¢â‚¬Â ÃƒÂ¢Ã¢â€šÂ¬Ã¢â€žÂ¢ÃƒÆ’Ã†â€™Ãƒâ€šÃ‚Â¢ÃƒÆ’Ã‚Â¢ÃƒÂ¢Ã¢â€šÂ¬Ã…Â¡Ãƒâ€šÃ‚Â¬ÃƒÆ’Ã¢â‚¬Â¦Ãƒâ€šÃ‚Â¡ÃƒÆ’Ã†â€™Ãƒâ€ Ã¢â‚¬â„¢ÃƒÆ’Ã‚Â¢ÃƒÂ¢Ã¢â‚¬Å¡Ã‚Â¬Ãƒâ€¦Ã‚Â¡ÃƒÆ’Ã†â€™ÃƒÂ¢Ã¢â€šÂ¬Ã…Â¡ÃƒÆ’Ã¢â‚¬Å¡Ãƒâ€šÃ‚Â¬ÃƒÆ’Ã†â€™Ãƒâ€ Ã¢â‚¬â„¢ÃƒÆ’Ã¢â‚¬Â ÃƒÂ¢Ã¢â€šÂ¬Ã¢â€žÂ¢ÃƒÆ’Ã†â€™ÃƒÂ¢Ã¢â€šÂ¬Ã‚Â ÃƒÆ’Ã‚Â¢ÃƒÂ¢Ã¢â‚¬Å¡Ã‚Â¬ÃƒÂ¢Ã¢â‚¬Å¾Ã‚Â¢ÃƒÆ’Ã†â€™Ãƒâ€ Ã¢â‚¬â„¢ÃƒÆ’Ã‚Â¢ÃƒÂ¢Ã¢â‚¬Å¡Ã‚Â¬Ãƒâ€šÃ‚Â ÃƒÆ’Ã†â€™Ãƒâ€šÃ‚Â¢ÃƒÆ’Ã‚Â¢ÃƒÂ¢Ã¢â€šÂ¬Ã…Â¡Ãƒâ€šÃ‚Â¬ÃƒÆ’Ã‚Â¢ÃƒÂ¢Ã¢â€šÂ¬Ã…Â¾Ãƒâ€šÃ‚Â¢ÃƒÆ’Ã†â€™Ãƒâ€ Ã¢â‚¬â„¢ÃƒÆ’Ã¢â‚¬Â ÃƒÂ¢Ã¢â€šÂ¬Ã¢â€žÂ¢ÃƒÆ’Ã†â€™ÃƒÂ¢Ã¢â€šÂ¬Ã…Â¡ÃƒÆ’Ã¢â‚¬Å¡Ãƒâ€šÃ‚Â¢ÃƒÆ’Ã†â€™Ãƒâ€ Ã¢â‚¬â„¢ÃƒÆ’Ã¢â‚¬Å¡Ãƒâ€šÃ‚Â¢ÃƒÆ’Ã†â€™Ãƒâ€šÃ‚Â¢ÃƒÆ’Ã‚Â¢ÃƒÂ¢Ã¢â€šÂ¬Ã…Â¡Ãƒâ€šÃ‚Â¬ÃƒÆ’Ã¢â‚¬Â¦Ãƒâ€šÃ‚Â¡ÃƒÆ’Ã†â€™ÃƒÂ¢Ã¢â€šÂ¬Ã…Â¡ÃƒÆ’Ã¢â‚¬Å¡Ãƒâ€šÃ‚Â¬ÃƒÆ’Ã†â€™Ãƒâ€ Ã¢â‚¬â„¢ÃƒÆ’Ã‚Â¢ÃƒÂ¢Ã¢â‚¬Å¡Ã‚Â¬Ãƒâ€¦Ã‚Â¡ÃƒÆ’Ã†â€™ÃƒÂ¢Ã¢â€šÂ¬Ã…Â¡ÃƒÆ’Ã¢â‚¬Å¡Ãƒâ€šÃ‚Â¦ÃƒÆ’Ã†â€™Ãƒâ€ Ã¢â‚¬â„¢ÃƒÆ’Ã¢â‚¬Â ÃƒÂ¢Ã¢â€šÂ¬Ã¢â€žÂ¢ÃƒÆ’Ã†â€™ÃƒÂ¢Ã¢â€šÂ¬Ã‚Â ÃƒÆ’Ã‚Â¢ÃƒÂ¢Ã¢â‚¬Å¡Ã‚Â¬ÃƒÂ¢Ã¢â‚¬Å¾Ã‚Â¢ÃƒÆ’Ã†â€™Ãƒâ€ Ã¢â‚¬â„¢ÃƒÆ’Ã‚Â¢ÃƒÂ¢Ã¢â‚¬Å¡Ã‚Â¬Ãƒâ€¦Ã‚Â¡ÃƒÆ’Ã†â€™ÃƒÂ¢Ã¢â€šÂ¬Ã…Â¡ÃƒÆ’Ã¢â‚¬Å¡Ãƒâ€šÃ‚Â¢ÃƒÆ’Ã†â€™Ãƒâ€ Ã¢â‚¬â„¢ÃƒÆ’Ã¢â‚¬Â ÃƒÂ¢Ã¢â€šÂ¬Ã¢â€žÂ¢ÃƒÆ’Ã†â€™ÃƒÂ¢Ã¢â€šÂ¬Ã…Â¡ÃƒÆ’Ã¢â‚¬Å¡Ãƒâ€šÃ‚Â¢ÃƒÆ’Ã†â€™Ãƒâ€ Ã¢â‚¬â„¢ÃƒÆ’Ã¢â‚¬Å¡Ãƒâ€šÃ‚Â¢ÃƒÆ’Ã†â€™Ãƒâ€šÃ‚Â¢ÃƒÆ’Ã‚Â¢ÃƒÂ¢Ã¢â‚¬Å¡Ã‚Â¬Ãƒâ€¦Ã‚Â¡ÃƒÆ’Ã¢â‚¬Å¡Ãƒâ€šÃ‚Â¬ÃƒÆ’Ã†â€™ÃƒÂ¢Ã¢â€šÂ¬Ã‚Â¦ÃƒÆ’Ã¢â‚¬Å¡Ãƒâ€šÃ‚Â¡ÃƒÆ’Ã†â€™Ãƒâ€ Ã¢â‚¬â„¢ÃƒÆ’Ã‚Â¢ÃƒÂ¢Ã¢â‚¬Å¡Ã‚Â¬Ãƒâ€¦Ã‚Â¡ÃƒÆ’Ã†â€™ÃƒÂ¢Ã¢â€šÂ¬Ã…Â¡ÃƒÆ’Ã¢â‚¬Å¡Ãƒâ€šÃ‚Â¬ÃƒÆ’Ã†â€™Ãƒâ€ Ã¢â‚¬â„¢ÃƒÆ’Ã¢â‚¬Â ÃƒÂ¢Ã¢â€šÂ¬Ã¢â€žÂ¢ÃƒÆ’Ã†â€™Ãƒâ€šÃ‚Â¢ÃƒÆ’Ã‚Â¢ÃƒÂ¢Ã¢â€šÂ¬Ã…Â¡Ãƒâ€šÃ‚Â¬ÃƒÆ’Ã¢â‚¬Å¡Ãƒâ€šÃ‚Â¦ÃƒÆ’Ã†â€™Ãƒâ€ Ã¢â‚¬â„¢ÃƒÆ’Ã¢â‚¬Å¡Ãƒâ€šÃ‚Â¢ÃƒÆ’Ã†â€™Ãƒâ€šÃ‚Â¢ÃƒÆ’Ã‚Â¢ÃƒÂ¢Ã¢â‚¬Å¡Ã‚Â¬Ãƒâ€¦Ã‚Â¡ÃƒÆ’Ã¢â‚¬Å¡Ãƒâ€šÃ‚Â¬ÃƒÆ’Ã†â€™ÃƒÂ¢Ã¢â€šÂ¬Ã‚Â¦ÃƒÆ’Ã‚Â¢ÃƒÂ¢Ã¢â‚¬Å¡Ã‚Â¬Ãƒâ€¦Ã¢â‚¬Å“3), TDS levels increased in both systems, with the Monoculture treatment showing slightly higher values (around 18.6 ppt) compared to the IMTA system (approximately 18.1 ppt).</w:t>
       </w:r>
     </w:p>
     <w:p>
@@ -6525,21 +6525,21 @@
         <w:rPr>
           <w:rFonts w:ascii="Times New Roman" w:hAnsi="Times New Roman" w:cs="Times New Roman"/>
         </w:rPr>
-        <w:t>The line graph illustrates the weekly changes in salinity levels (measured in ppt) for Integrated Multi-Trophic Aquaculture (IMTA) and Monoculture treatments over a seven-week period. At the start of the study (Week 1), both treatments recorded identical salinity levels of approximately 20.6 ppt. During the early phase (Weeks 2ÃƒÆ’Ã†â€™Ãƒâ€ Ã¢â‚¬â„¢ÃƒÆ’Ã¢â‚¬Â ÃƒÂ¢Ã¢â€šÂ¬Ã¢â€žÂ¢ÃƒÆ’Ã†â€™ÃƒÂ¢Ã¢â€šÂ¬Ã‚Â ÃƒÆ’Ã‚Â¢ÃƒÂ¢Ã¢â‚¬Å¡Ã‚Â¬ÃƒÂ¢Ã¢â‚¬Å¾Ã‚Â¢ÃƒÆ’Ã†â€™Ãƒâ€ Ã¢â‚¬â„¢ÃƒÆ’Ã‚Â¢ÃƒÂ¢Ã¢â‚¬Å¡Ã‚Â¬Ãƒâ€šÃ‚Â ÃƒÆ’Ã†â€™Ãƒâ€šÃ‚Â¢ÃƒÆ’Ã‚Â¢ÃƒÂ¢Ã¢â€šÂ¬Ã…Â¡Ãƒâ€šÃ‚Â¬ÃƒÆ’Ã‚Â¢ÃƒÂ¢Ã¢â€šÂ¬Ã…Â¾Ãƒâ€šÃ‚Â¢ÃƒÆ’Ã†â€™Ãƒâ€ Ã¢â‚¬â„¢ÃƒÆ’Ã¢â‚¬Â ÃƒÂ¢Ã¢â€šÂ¬Ã¢â€žÂ¢ÃƒÆ’Ã†â€™Ãƒâ€šÃ‚Â¢ÃƒÆ’Ã‚Â¢ÃƒÂ¢Ã¢â€šÂ¬Ã…Â¡Ãƒâ€šÃ‚Â¬ÃƒÆ’Ã¢â‚¬Å¡Ãƒâ€šÃ‚Â ÃƒÆ’Ã†â€™Ãƒâ€ Ã¢â‚¬â„¢ÃƒÆ’Ã¢â‚¬Å¡Ãƒâ€šÃ‚Â¢ÃƒÆ’Ã†â€™Ãƒâ€šÃ‚Â¢ÃƒÆ’Ã‚Â¢ÃƒÂ¢Ã¢â‚¬Å¡Ã‚Â¬Ãƒâ€¦Ã‚Â¡ÃƒÆ’Ã¢â‚¬Å¡Ãƒâ€šÃ‚Â¬ÃƒÆ’Ã†â€™Ãƒâ€šÃ‚Â¢ÃƒÆ’Ã‚Â¢ÃƒÂ¢Ã¢â‚¬Å¡Ã‚Â¬Ãƒâ€¦Ã‚Â¾ÃƒÆ’Ã¢â‚¬Å¡Ãƒâ€šÃ‚Â¢ÃƒÆ’Ã†â€™Ãƒâ€ Ã¢â‚¬â„¢ÃƒÆ’Ã¢â‚¬Â ÃƒÂ¢Ã¢â€šÂ¬Ã¢â€žÂ¢ÃƒÆ’Ã†â€™ÃƒÂ¢Ã¢â€šÂ¬Ã‚Â ÃƒÆ’Ã‚Â¢ÃƒÂ¢Ã¢â‚¬Å¡Ã‚Â¬ÃƒÂ¢Ã¢â‚¬Å¾Ã‚Â¢ÃƒÆ’Ã†â€™Ãƒâ€ Ã¢â‚¬â„¢ÃƒÆ’Ã¢â‚¬Å¡Ãƒâ€šÃ‚Â¢ÃƒÆ’Ã†â€™Ãƒâ€šÃ‚Â¢ÃƒÆ’Ã‚Â¢ÃƒÂ¢Ã¢â‚¬Å¡Ã‚Â¬Ãƒâ€¦Ã‚Â¡ÃƒÆ’Ã¢â‚¬Å¡Ãƒâ€šÃ‚Â¬ÃƒÆ’Ã†â€™ÃƒÂ¢Ã¢â€šÂ¬Ã‚Â¦ÃƒÆ’Ã¢â‚¬Å¡Ãƒâ€šÃ‚Â¡ÃƒÆ’Ã†â€™Ãƒâ€ Ã¢â‚¬â„¢ÃƒÆ’Ã¢â‚¬Â ÃƒÂ¢Ã¢â€šÂ¬Ã¢â€žÂ¢ÃƒÆ’Ã†â€™Ãƒâ€šÃ‚Â¢ÃƒÆ’Ã‚Â¢ÃƒÂ¢Ã¢â€šÂ¬Ã…Â¡Ãƒâ€šÃ‚Â¬ÃƒÆ’Ã¢â‚¬Â¦Ãƒâ€šÃ‚Â¡ÃƒÆ’Ã†â€™Ãƒâ€ Ã¢â‚¬â„¢ÃƒÆ’Ã‚Â¢ÃƒÂ¢Ã¢â‚¬Å¡Ã‚Â¬Ãƒâ€¦Ã‚Â¡ÃƒÆ’Ã†â€™ÃƒÂ¢Ã¢â€šÂ¬Ã…Â¡ÃƒÆ’Ã¢â‚¬Å¡Ãƒâ€šÃ‚Â¢ÃƒÆ’Ã†â€™Ãƒâ€ Ã¢â‚¬â„¢ÃƒÆ’Ã¢â‚¬Â ÃƒÂ¢Ã¢â€šÂ¬Ã¢â€žÂ¢ÃƒÆ’Ã†â€™ÃƒÂ¢Ã¢â€šÂ¬Ã‚Â ÃƒÆ’Ã‚Â¢ÃƒÂ¢Ã¢â‚¬Å¡Ã‚Â¬ÃƒÂ¢Ã¢â‚¬Å¾Ã‚Â¢ÃƒÆ’Ã†â€™Ãƒâ€ Ã¢â‚¬â„¢ÃƒÆ’Ã‚Â¢ÃƒÂ¢Ã¢â‚¬Å¡Ã‚Â¬Ãƒâ€šÃ‚Â ÃƒÆ’Ã†â€™Ãƒâ€šÃ‚Â¢ÃƒÆ’Ã‚Â¢ÃƒÂ¢Ã¢â€šÂ¬Ã…Â¡Ãƒâ€šÃ‚Â¬ÃƒÆ’Ã‚Â¢ÃƒÂ¢Ã¢â€šÂ¬Ã…Â¾Ãƒâ€šÃ‚Â¢ÃƒÆ’Ã†â€™Ãƒâ€ Ã¢â‚¬â„¢ÃƒÆ’Ã¢â‚¬Â ÃƒÂ¢Ã¢â€šÂ¬Ã¢â€žÂ¢ÃƒÆ’Ã†â€™Ãƒâ€šÃ‚Â¢ÃƒÆ’Ã‚Â¢ÃƒÂ¢Ã¢â€šÂ¬Ã…Â¡Ãƒâ€šÃ‚Â¬ÃƒÆ’Ã¢â‚¬Â¦Ãƒâ€šÃ‚Â¡ÃƒÆ’Ã†â€™Ãƒâ€ Ã¢â‚¬â„¢ÃƒÆ’Ã‚Â¢ÃƒÂ¢Ã¢â‚¬Å¡Ã‚Â¬Ãƒâ€¦Ã‚Â¡ÃƒÆ’Ã†â€™ÃƒÂ¢Ã¢â€šÂ¬Ã…Â¡ÃƒÆ’Ã¢â‚¬Å¡Ãƒâ€šÃ‚Â¢ÃƒÆ’Ã†â€™Ãƒâ€ Ã¢â‚¬â„¢ÃƒÆ’Ã¢â‚¬Â ÃƒÂ¢Ã¢â€šÂ¬Ã¢â€žÂ¢ÃƒÆ’Ã†â€™ÃƒÂ¢Ã¢â€šÂ¬Ã‚Â ÃƒÆ’Ã‚Â¢ÃƒÂ¢Ã¢â‚¬Å¡Ã‚Â¬ÃƒÂ¢Ã¢â‚¬Å¾Ã‚Â¢ÃƒÆ’Ã†â€™Ãƒâ€ Ã¢â‚¬â„¢ÃƒÆ’Ã‚Â¢ÃƒÂ¢Ã¢â‚¬Å¡Ã‚Â¬Ãƒâ€¦Ã‚Â¡ÃƒÆ’Ã†â€™ÃƒÂ¢Ã¢â€šÂ¬Ã…Â¡ÃƒÆ’Ã¢â‚¬Å¡Ãƒâ€šÃ‚Â¢ÃƒÆ’Ã†â€™Ãƒâ€ Ã¢â‚¬â„¢ÃƒÆ’Ã¢â‚¬Â ÃƒÂ¢Ã¢â€šÂ¬Ã¢â€žÂ¢ÃƒÆ’Ã†â€™ÃƒÂ¢Ã¢â€šÂ¬Ã…Â¡ÃƒÆ’Ã¢â‚¬Å¡Ãƒâ€šÃ‚Â¢ÃƒÆ’Ã†â€™Ãƒâ€ Ã¢â‚¬â„¢ÃƒÆ’Ã¢â‚¬Å¡Ãƒâ€šÃ‚Â¢ÃƒÆ’Ã†â€™Ãƒâ€šÃ‚Â¢ÃƒÆ’Ã‚Â¢ÃƒÂ¢Ã¢â‚¬Å¡Ã‚Â¬Ãƒâ€¦Ã‚Â¡ÃƒÆ’Ã¢â‚¬Å¡Ãƒâ€šÃ‚Â¬ÃƒÆ’Ã†â€™ÃƒÂ¢Ã¢â€šÂ¬Ã‚Â¦ÃƒÆ’Ã¢â‚¬Å¡Ãƒâ€šÃ‚Â¡ÃƒÆ’Ã†â€™Ãƒâ€ Ã¢â‚¬â„¢ÃƒÆ’Ã‚Â¢ÃƒÂ¢Ã¢â‚¬Å¡Ã‚Â¬Ãƒâ€¦Ã‚Â¡ÃƒÆ’Ã†â€™ÃƒÂ¢Ã¢â€šÂ¬Ã…Â¡ÃƒÆ’Ã¢â‚¬Å¡Ãƒâ€šÃ‚Â¬ÃƒÆ’Ã†â€™Ãƒâ€ Ã¢â‚¬â„¢ÃƒÆ’Ã¢â‚¬Â ÃƒÂ¢Ã¢â€šÂ¬Ã¢â€žÂ¢ÃƒÆ’Ã†â€™Ãƒâ€šÃ‚Â¢ÃƒÆ’Ã‚Â¢ÃƒÂ¢Ã¢â€šÂ¬Ã…Â¡Ãƒâ€šÃ‚Â¬ÃƒÆ’Ã¢â‚¬Å¡Ãƒâ€šÃ‚Â¦ÃƒÆ’Ã†â€™Ãƒâ€ Ã¢â‚¬â„¢ÃƒÆ’Ã‚Â¢ÃƒÂ¢Ã¢â‚¬Å¡Ã‚Â¬Ãƒâ€¦Ã‚Â¡ÃƒÆ’Ã†â€™ÃƒÂ¢Ã¢â€šÂ¬Ã…Â¡ÃƒÆ’Ã¢â‚¬Å¡Ãƒâ€šÃ‚Â¡ÃƒÆ’Ã†â€™Ãƒâ€ Ã¢â‚¬â„¢ÃƒÆ’Ã¢â‚¬Â ÃƒÂ¢Ã¢â€šÂ¬Ã¢â€žÂ¢ÃƒÆ’Ã†â€™ÃƒÂ¢Ã¢â€šÂ¬Ã‚Â ÃƒÆ’Ã‚Â¢ÃƒÂ¢Ã¢â‚¬Å¡Ã‚Â¬ÃƒÂ¢Ã¢â‚¬Å¾Ã‚Â¢ÃƒÆ’Ã†â€™Ãƒâ€ Ã¢â‚¬â„¢ÃƒÆ’Ã¢â‚¬Å¡Ãƒâ€šÃ‚Â¢ÃƒÆ’Ã†â€™Ãƒâ€šÃ‚Â¢ÃƒÆ’Ã‚Â¢ÃƒÂ¢Ã¢â‚¬Å¡Ã‚Â¬Ãƒâ€¦Ã‚Â¡ÃƒÆ’Ã¢â‚¬Å¡Ãƒâ€šÃ‚Â¬ÃƒÆ’Ã†â€™ÃƒÂ¢Ã¢â€šÂ¬Ã‚Â¦ÃƒÆ’Ã¢â‚¬Å¡Ãƒâ€šÃ‚Â¡ÃƒÆ’Ã†â€™Ãƒâ€ Ã¢â‚¬â„¢ÃƒÆ’Ã¢â‚¬Â ÃƒÂ¢Ã¢â€šÂ¬Ã¢â€žÂ¢ÃƒÆ’Ã†â€™Ãƒâ€šÃ‚Â¢ÃƒÆ’Ã‚Â¢ÃƒÂ¢Ã¢â€šÂ¬Ã…Â¡Ãƒâ€šÃ‚Â¬ÃƒÆ’Ã¢â‚¬Â¦Ãƒâ€šÃ‚Â¡ÃƒÆ’Ã†â€™Ãƒâ€ Ã¢â‚¬â„¢ÃƒÆ’Ã‚Â¢ÃƒÂ¢Ã¢â‚¬Å¡Ã‚Â¬Ãƒâ€¦Ã‚Â¡ÃƒÆ’Ã†â€™ÃƒÂ¢Ã¢â€šÂ¬Ã…Â¡ÃƒÆ’Ã¢â‚¬Å¡Ãƒâ€šÃ‚Â¬ÃƒÆ’Ã†â€™Ãƒâ€ Ã¢â‚¬â„¢ÃƒÆ’Ã¢â‚¬Â ÃƒÂ¢Ã¢â€šÂ¬Ã¢â€žÂ¢ÃƒÆ’Ã†â€™ÃƒÂ¢Ã¢â€šÂ¬Ã‚Â ÃƒÆ’Ã‚Â¢ÃƒÂ¢Ã¢â‚¬Å¡Ã‚Â¬ÃƒÂ¢Ã¢â‚¬Å¾Ã‚Â¢ÃƒÆ’Ã†â€™Ãƒâ€ Ã¢â‚¬â„¢ÃƒÆ’Ã‚Â¢ÃƒÂ¢Ã¢â‚¬Å¡Ã‚Â¬Ãƒâ€šÃ‚Â ÃƒÆ’Ã†â€™Ãƒâ€šÃ‚Â¢ÃƒÆ’Ã‚Â¢ÃƒÂ¢Ã¢â€šÂ¬Ã…Â¡Ãƒâ€šÃ‚Â¬ÃƒÆ’Ã‚Â¢ÃƒÂ¢Ã¢â€šÂ¬Ã…Â¾Ãƒâ€šÃ‚Â¢ÃƒÆ’Ã†â€™Ãƒâ€ Ã¢â‚¬â„¢ÃƒÆ’Ã¢â‚¬Â ÃƒÂ¢Ã¢â€šÂ¬Ã¢â€žÂ¢ÃƒÆ’Ã†â€™Ãƒâ€šÃ‚Â¢ÃƒÆ’Ã‚Â¢ÃƒÂ¢Ã¢â€šÂ¬Ã…Â¡Ãƒâ€šÃ‚Â¬ÃƒÆ’Ã¢â‚¬Â¦Ãƒâ€šÃ‚Â¡ÃƒÆ’Ã†â€™Ãƒâ€ Ã¢â‚¬â„¢ÃƒÆ’Ã‚Â¢ÃƒÂ¢Ã¢â‚¬Å¡Ã‚Â¬Ãƒâ€¦Ã‚Â¡ÃƒÆ’Ã†â€™ÃƒÂ¢Ã¢â€šÂ¬Ã…Â¡ÃƒÆ’Ã¢â‚¬Å¡Ãƒâ€šÃ‚Â¢ÃƒÆ’Ã†â€™Ãƒâ€ Ã¢â‚¬â„¢ÃƒÆ’Ã¢â‚¬Â ÃƒÂ¢Ã¢â€šÂ¬Ã¢â€žÂ¢ÃƒÆ’Ã†â€™ÃƒÂ¢Ã¢â€šÂ¬Ã‚Â ÃƒÆ’Ã‚Â¢ÃƒÂ¢Ã¢â‚¬Å¡Ã‚Â¬ÃƒÂ¢Ã¢â‚¬Å¾Ã‚Â¢ÃƒÆ’Ã†â€™Ãƒâ€ Ã¢â‚¬â„¢ÃƒÆ’Ã‚Â¢ÃƒÂ¢Ã¢â‚¬Å¡Ã‚Â¬Ãƒâ€¦Ã‚Â¡ÃƒÆ’Ã†â€™ÃƒÂ¢Ã¢â€šÂ¬Ã…Â¡ÃƒÆ’Ã¢â‚¬Å¡Ãƒâ€šÃ‚Â¢ÃƒÆ’Ã†â€™Ãƒâ€ Ã¢â‚¬â„¢ÃƒÆ’Ã¢â‚¬Â ÃƒÂ¢Ã¢â€šÂ¬Ã¢â€žÂ¢ÃƒÆ’Ã†â€™ÃƒÂ¢Ã¢â€šÂ¬Ã…Â¡ÃƒÆ’Ã¢â‚¬Å¡Ãƒâ€šÃ‚Â¢ÃƒÆ’Ã†â€™Ãƒâ€ Ã¢â‚¬â„¢ÃƒÆ’Ã¢â‚¬Å¡Ãƒâ€šÃ‚Â¢ÃƒÆ’Ã†â€™Ãƒâ€šÃ‚Â¢ÃƒÆ’Ã‚Â¢ÃƒÂ¢Ã¢â€šÂ¬Ã…Â¡Ãƒâ€šÃ‚Â¬ÃƒÆ’Ã¢â‚¬Â¦Ãƒâ€šÃ‚Â¡ÃƒÆ’Ã†â€™ÃƒÂ¢Ã¢â€šÂ¬Ã…Â¡ÃƒÆ’Ã¢â‚¬Å¡Ãƒâ€šÃ‚Â¬ÃƒÆ’Ã†â€™Ãƒâ€ Ã¢â‚¬â„¢ÃƒÆ’Ã‚Â¢ÃƒÂ¢Ã¢â‚¬Å¡Ã‚Â¬Ãƒâ€šÃ‚Â¦ÃƒÆ’Ã†â€™ÃƒÂ¢Ã¢â€šÂ¬Ã…Â¡ÃƒÆ’Ã¢â‚¬Å¡Ãƒâ€šÃ‚Â¡ÃƒÆ’Ã†â€™Ãƒâ€ Ã¢â‚¬â„¢ÃƒÆ’Ã¢â‚¬Â ÃƒÂ¢Ã¢â€šÂ¬Ã¢â€žÂ¢ÃƒÆ’Ã†â€™Ãƒâ€šÃ‚Â¢ÃƒÆ’Ã‚Â¢ÃƒÂ¢Ã¢â€šÂ¬Ã…Â¡Ãƒâ€šÃ‚Â¬ÃƒÆ’Ã¢â‚¬Â¦Ãƒâ€šÃ‚Â¡ÃƒÆ’Ã†â€™Ãƒâ€ Ã¢â‚¬â„¢ÃƒÆ’Ã‚Â¢ÃƒÂ¢Ã¢â‚¬Å¡Ã‚Â¬Ãƒâ€¦Ã‚Â¡ÃƒÆ’Ã†â€™ÃƒÂ¢Ã¢â€šÂ¬Ã…Â¡ÃƒÆ’Ã¢â‚¬Å¡Ãƒâ€šÃ‚Â¬ÃƒÆ’Ã†â€™Ãƒâ€ Ã¢â‚¬â„¢ÃƒÆ’Ã¢â‚¬Â ÃƒÂ¢Ã¢â€šÂ¬Ã¢â€žÂ¢ÃƒÆ’Ã†â€™ÃƒÂ¢Ã¢â€šÂ¬Ã‚Â ÃƒÆ’Ã‚Â¢ÃƒÂ¢Ã¢â‚¬Å¡Ã‚Â¬ÃƒÂ¢Ã¢â‚¬Å¾Ã‚Â¢ÃƒÆ’Ã†â€™Ãƒâ€ Ã¢â‚¬â„¢ÃƒÆ’Ã¢â‚¬Å¡Ãƒâ€šÃ‚Â¢ÃƒÆ’Ã†â€™Ãƒâ€šÃ‚Â¢ÃƒÆ’Ã‚Â¢ÃƒÂ¢Ã¢â‚¬Å¡Ã‚Â¬Ãƒâ€¦Ã‚Â¡ÃƒÆ’Ã¢â‚¬Å¡Ãƒâ€šÃ‚Â¬ÃƒÆ’Ã†â€™ÃƒÂ¢Ã¢â€šÂ¬Ã…Â¡ÃƒÆ’Ã¢â‚¬Å¡Ãƒâ€šÃ‚Â¦ÃƒÆ’Ã†â€™Ãƒâ€ Ã¢â‚¬â„¢ÃƒÆ’Ã¢â‚¬Â ÃƒÂ¢Ã¢â€šÂ¬Ã¢â€žÂ¢ÃƒÆ’Ã†â€™ÃƒÂ¢Ã¢â€šÂ¬Ã…Â¡ÃƒÆ’Ã¢â‚¬Å¡Ãƒâ€šÃ‚Â¢ÃƒÆ’Ã†â€™Ãƒâ€ Ã¢â‚¬â„¢ÃƒÆ’Ã¢â‚¬Å¡Ãƒâ€šÃ‚Â¢ÃƒÆ’Ã†â€™Ãƒâ€šÃ‚Â¢ÃƒÆ’Ã‚Â¢ÃƒÂ¢Ã¢â€šÂ¬Ã…Â¡Ãƒâ€šÃ‚Â¬ÃƒÆ’Ã¢â‚¬Â¦Ãƒâ€šÃ‚Â¡ÃƒÆ’Ã†â€™ÃƒÂ¢Ã¢â€šÂ¬Ã…Â¡ÃƒÆ’Ã¢â‚¬Å¡Ãƒâ€šÃ‚Â¬ÃƒÆ’Ã†â€™Ãƒâ€ Ã¢â‚¬â„¢ÃƒÆ’Ã‚Â¢ÃƒÂ¢Ã¢â‚¬Å¡Ã‚Â¬Ãƒâ€šÃ‚Â¦ÃƒÆ’Ã†â€™Ãƒâ€šÃ‚Â¢ÃƒÆ’Ã‚Â¢ÃƒÂ¢Ã¢â€šÂ¬Ã…Â¡Ãƒâ€šÃ‚Â¬ÃƒÆ’Ã¢â‚¬Â¦ÃƒÂ¢Ã¢â€šÂ¬Ã…â€œ3), salinity increased in both systems; however, the Monoculture treatment consistently showed higher values (around 23.5 ppt) compared to the IMTA system (approximately 22.9 ppt).</w:t>
-      </w:r>
-    </w:p>
-    <w:p>
-      <w:pPr>
-        <w:spacing w:line="360" w:lineRule="auto"/>
-        <w:rPr>
-          <w:rFonts w:ascii="Times New Roman" w:hAnsi="Times New Roman" w:cs="Times New Roman"/>
-        </w:rPr>
-      </w:pPr>
-      <w:r>
-        <w:rPr>
-          <w:rFonts w:ascii="Times New Roman" w:hAnsi="Times New Roman" w:cs="Times New Roman"/>
-        </w:rPr>
-        <w:t xml:space="preserve">In the mid-phase of the study (Weeks 4ÃƒÆ’Ã†â€™Ãƒâ€ Ã¢â‚¬â„¢ÃƒÆ’Ã¢â‚¬Â ÃƒÂ¢Ã¢â€šÂ¬Ã¢â€žÂ¢ÃƒÆ’Ã†â€™ÃƒÂ¢Ã¢â€šÂ¬Ã‚Â ÃƒÆ’Ã‚Â¢ÃƒÂ¢Ã¢â‚¬Å¡Ã‚Â¬ÃƒÂ¢Ã¢â‚¬Å¾Ã‚Â¢ÃƒÆ’Ã†â€™Ãƒâ€ Ã¢â‚¬â„¢ÃƒÆ’Ã‚Â¢ÃƒÂ¢Ã¢â‚¬Å¡Ã‚Â¬Ãƒâ€šÃ‚Â ÃƒÆ’Ã†â€™Ãƒâ€šÃ‚Â¢ÃƒÆ’Ã‚Â¢ÃƒÂ¢Ã¢â€šÂ¬Ã…Â¡Ãƒâ€šÃ‚Â¬ÃƒÆ’Ã‚Â¢ÃƒÂ¢Ã¢â€šÂ¬Ã…Â¾Ãƒâ€šÃ‚Â¢ÃƒÆ’Ã†â€™Ãƒâ€ Ã¢â‚¬â„¢ÃƒÆ’Ã¢â‚¬Â ÃƒÂ¢Ã¢â€šÂ¬Ã¢â€žÂ¢ÃƒÆ’Ã†â€™Ãƒâ€šÃ‚Â¢ÃƒÆ’Ã‚Â¢ÃƒÂ¢Ã¢â€šÂ¬Ã…Â¡Ãƒâ€šÃ‚Â¬ÃƒÆ’Ã¢â‚¬Å¡Ãƒâ€šÃ‚Â ÃƒÆ’Ã†â€™Ãƒâ€ Ã¢â‚¬â„¢ÃƒÆ’Ã¢â‚¬Å¡Ãƒâ€šÃ‚Â¢ÃƒÆ’Ã†â€™Ãƒâ€šÃ‚Â¢ÃƒÆ’Ã‚Â¢ÃƒÂ¢Ã¢â‚¬Å¡Ã‚Â¬Ãƒâ€¦Ã‚Â¡ÃƒÆ’Ã¢â‚¬Å¡Ãƒâ€šÃ‚Â¬ÃƒÆ’Ã†â€™Ãƒâ€šÃ‚Â¢ÃƒÆ’Ã‚Â¢ÃƒÂ¢Ã¢â‚¬Å¡Ã‚Â¬Ãƒâ€¦Ã‚Â¾ÃƒÆ’Ã¢â‚¬Å¡Ãƒâ€šÃ‚Â¢ÃƒÆ’Ã†â€™Ãƒâ€ Ã¢â‚¬â„¢ÃƒÆ’Ã¢â‚¬Â ÃƒÂ¢Ã¢â€šÂ¬Ã¢â€žÂ¢ÃƒÆ’Ã†â€™ÃƒÂ¢Ã¢â€šÂ¬Ã‚Â ÃƒÆ’Ã‚Â¢ÃƒÂ¢Ã¢â‚¬Å¡Ã‚Â¬ÃƒÂ¢Ã¢â‚¬Å¾Ã‚Â¢ÃƒÆ’Ã†â€™Ãƒâ€ Ã¢â‚¬â„¢ÃƒÆ’Ã¢â‚¬Å¡Ãƒâ€šÃ‚Â¢ÃƒÆ’Ã†â€™Ãƒâ€šÃ‚Â¢ÃƒÆ’Ã‚Â¢ÃƒÂ¢Ã¢â‚¬Å¡Ã‚Â¬Ãƒâ€¦Ã‚Â¡ÃƒÆ’Ã¢â‚¬Å¡Ãƒâ€šÃ‚Â¬ÃƒÆ’Ã†â€™ÃƒÂ¢Ã¢â€šÂ¬Ã‚Â¦ÃƒÆ’Ã¢â‚¬Å¡Ãƒâ€šÃ‚Â¡ÃƒÆ’Ã†â€™Ãƒâ€ Ã¢â‚¬â„¢ÃƒÆ’Ã¢â‚¬Â ÃƒÂ¢Ã¢â€šÂ¬Ã¢â€žÂ¢ÃƒÆ’Ã†â€™Ãƒâ€šÃ‚Â¢ÃƒÆ’Ã‚Â¢ÃƒÂ¢Ã¢â€šÂ¬Ã…Â¡Ãƒâ€šÃ‚Â¬ÃƒÆ’Ã¢â‚¬Â¦Ãƒâ€šÃ‚Â¡ÃƒÆ’Ã†â€™Ãƒâ€ Ã¢â‚¬â„¢ÃƒÆ’Ã‚Â¢ÃƒÂ¢Ã¢â‚¬Å¡Ã‚Â¬Ãƒâ€¦Ã‚Â¡ÃƒÆ’Ã†â€™ÃƒÂ¢Ã¢â€šÂ¬Ã…Â¡ÃƒÆ’Ã¢â‚¬Å¡Ãƒâ€šÃ‚Â¢ÃƒÆ’Ã†â€™Ãƒâ€ Ã¢â‚¬â„¢ÃƒÆ’Ã¢â‚¬Â ÃƒÂ¢Ã¢â€šÂ¬Ã¢â€žÂ¢ÃƒÆ’Ã†â€™ÃƒÂ¢Ã¢â€šÂ¬Ã‚Â ÃƒÆ’Ã‚Â¢ÃƒÂ¢Ã¢â‚¬Å¡Ã‚Â¬ÃƒÂ¢Ã¢â‚¬Å¾Ã‚Â¢ÃƒÆ’Ã†â€™Ãƒâ€ Ã¢â‚¬â„¢ÃƒÆ’Ã‚Â¢ÃƒÂ¢Ã¢â‚¬Å¡Ã‚Â¬Ãƒâ€šÃ‚Â ÃƒÆ’Ã†â€™Ãƒâ€šÃ‚Â¢ÃƒÆ’Ã‚Â¢ÃƒÂ¢Ã¢â€šÂ¬Ã…Â¡Ãƒâ€šÃ‚Â¬ÃƒÆ’Ã‚Â¢ÃƒÂ¢Ã¢â€šÂ¬Ã…Â¾Ãƒâ€šÃ‚Â¢ÃƒÆ’Ã†â€™Ãƒâ€ Ã¢â‚¬â„¢ÃƒÆ’Ã¢â‚¬Â ÃƒÂ¢Ã¢â€šÂ¬Ã¢â€žÂ¢ÃƒÆ’Ã†â€™Ãƒâ€šÃ‚Â¢ÃƒÆ’Ã‚Â¢ÃƒÂ¢Ã¢â€šÂ¬Ã…Â¡Ãƒâ€šÃ‚Â¬ÃƒÆ’Ã¢â‚¬Â¦Ãƒâ€šÃ‚Â¡ÃƒÆ’Ã†â€™Ãƒâ€ Ã¢â‚¬â„¢ÃƒÆ’Ã‚Â¢ÃƒÂ¢Ã¢â‚¬Å¡Ã‚Â¬Ãƒâ€¦Ã‚Â¡ÃƒÆ’Ã†â€™ÃƒÂ¢Ã¢â€šÂ¬Ã…Â¡ÃƒÆ’Ã¢â‚¬Å¡Ãƒâ€šÃ‚Â¢ÃƒÆ’Ã†â€™Ãƒâ€ Ã¢â‚¬â„¢ÃƒÆ’Ã¢â‚¬Â ÃƒÂ¢Ã¢â€šÂ¬Ã¢â€žÂ¢ÃƒÆ’Ã†â€™ÃƒÂ¢Ã¢â€šÂ¬Ã‚Â ÃƒÆ’Ã‚Â¢ÃƒÂ¢Ã¢â‚¬Å¡Ã‚Â¬ÃƒÂ¢Ã¢â‚¬Å¾Ã‚Â¢ÃƒÆ’Ã†â€™Ãƒâ€ Ã¢â‚¬â„¢ÃƒÆ’Ã‚Â¢ÃƒÂ¢Ã¢â‚¬Å¡Ã‚Â¬Ãƒâ€¦Ã‚Â¡ÃƒÆ’Ã†â€™ÃƒÂ¢Ã¢â€šÂ¬Ã…Â¡ÃƒÆ’Ã¢â‚¬Å¡Ãƒâ€šÃ‚Â¢ÃƒÆ’Ã†â€™Ãƒâ€ Ã¢â‚¬â„¢ÃƒÆ’Ã¢â‚¬Â ÃƒÂ¢Ã¢â€šÂ¬Ã¢â€žÂ¢ÃƒÆ’Ã†â€™ÃƒÂ¢Ã¢â€šÂ¬Ã…Â¡ÃƒÆ’Ã¢â‚¬Å¡Ãƒâ€šÃ‚Â¢ÃƒÆ’Ã†â€™Ãƒâ€ Ã¢â‚¬â„¢ÃƒÆ’Ã¢â‚¬Å¡Ãƒâ€šÃ‚Â¢ÃƒÆ’Ã†â€™Ãƒâ€šÃ‚Â¢ÃƒÆ’Ã‚Â¢ÃƒÂ¢Ã¢â‚¬Å¡Ã‚Â¬Ãƒâ€¦Ã‚Â¡ÃƒÆ’Ã¢â‚¬Å¡Ãƒâ€šÃ‚Â¬ÃƒÆ’Ã†â€™ÃƒÂ¢Ã¢â€šÂ¬Ã‚Â¦ÃƒÆ’Ã¢â‚¬Å¡Ãƒâ€šÃ‚Â¡ÃƒÆ’Ã†â€™Ãƒâ€ Ã¢â‚¬â„¢ÃƒÆ’Ã‚Â¢ÃƒÂ¢Ã¢â‚¬Å¡Ã‚Â¬Ãƒâ€¦Ã‚Â¡ÃƒÆ’Ã†â€™ÃƒÂ¢Ã¢â€šÂ¬Ã…Â¡ÃƒÆ’Ã¢â‚¬Å¡Ãƒâ€šÃ‚Â¬ÃƒÆ’Ã†â€™Ãƒâ€ Ã¢â‚¬â„¢ÃƒÆ’Ã¢â‚¬Â ÃƒÂ¢Ã¢â€šÂ¬Ã¢â€žÂ¢ÃƒÆ’Ã†â€™Ãƒâ€šÃ‚Â¢ÃƒÆ’Ã‚Â¢ÃƒÂ¢Ã¢â€šÂ¬Ã…Â¡Ãƒâ€šÃ‚Â¬ÃƒÆ’Ã¢â‚¬Å¡Ãƒâ€šÃ‚Â¦ÃƒÆ’Ã†â€™Ãƒâ€ Ã¢â‚¬â„¢ÃƒÆ’Ã‚Â¢ÃƒÂ¢Ã¢â‚¬Å¡Ã‚Â¬Ãƒâ€¦Ã‚Â¡ÃƒÆ’Ã†â€™ÃƒÂ¢Ã¢â€šÂ¬Ã…Â¡ÃƒÆ’Ã¢â‚¬Å¡Ãƒâ€šÃ‚Â¡ÃƒÆ’Ã†â€™Ãƒâ€ Ã¢â‚¬â„¢ÃƒÆ’Ã¢â‚¬Â ÃƒÂ¢Ã¢â€šÂ¬Ã¢â€žÂ¢ÃƒÆ’Ã†â€™ÃƒÂ¢Ã¢â€šÂ¬Ã‚Â ÃƒÆ’Ã‚Â¢ÃƒÂ¢Ã¢â‚¬Å¡Ã‚Â¬ÃƒÂ¢Ã¢â‚¬Å¾Ã‚Â¢ÃƒÆ’Ã†â€™Ãƒâ€ Ã¢â‚¬â„¢ÃƒÆ’Ã¢â‚¬Å¡Ãƒâ€šÃ‚Â¢ÃƒÆ’Ã†â€™Ãƒâ€šÃ‚Â¢ÃƒÆ’Ã‚Â¢ÃƒÂ¢Ã¢â‚¬Å¡Ã‚Â¬Ãƒâ€¦Ã‚Â¡ÃƒÆ’Ã¢â‚¬Å¡Ãƒâ€šÃ‚Â¬ÃƒÆ’Ã†â€™ÃƒÂ¢Ã¢â€šÂ¬Ã‚Â¦ÃƒÆ’Ã¢â‚¬Å¡Ãƒâ€šÃ‚Â¡ÃƒÆ’Ã†â€™Ãƒâ€ Ã¢â‚¬â„¢ÃƒÆ’Ã¢â‚¬Â ÃƒÂ¢Ã¢â€šÂ¬Ã¢â€žÂ¢ÃƒÆ’Ã†â€™Ãƒâ€šÃ‚Â¢ÃƒÆ’Ã‚Â¢ÃƒÂ¢Ã¢â€šÂ¬Ã…Â¡Ãƒâ€šÃ‚Â¬ÃƒÆ’Ã¢â‚¬Â¦Ãƒâ€šÃ‚Â¡ÃƒÆ’Ã†â€™Ãƒâ€ Ã¢â‚¬â„¢ÃƒÆ’Ã‚Â¢ÃƒÂ¢Ã¢â‚¬Å¡Ã‚Â¬Ãƒâ€¦Ã‚Â¡ÃƒÆ’Ã†â€™ÃƒÂ¢Ã¢â€šÂ¬Ã…Â¡ÃƒÆ’Ã¢â‚¬Å¡Ãƒâ€šÃ‚Â¬ÃƒÆ’Ã†â€™Ãƒâ€ Ã¢â‚¬â„¢ÃƒÆ’Ã¢â‚¬Â ÃƒÂ¢Ã¢â€šÂ¬Ã¢â€žÂ¢ÃƒÆ’Ã†â€™ÃƒÂ¢Ã¢â€šÂ¬Ã‚Â ÃƒÆ’Ã‚Â¢ÃƒÂ¢Ã¢â‚¬Å¡Ã‚Â¬ÃƒÂ¢Ã¢â‚¬Å¾Ã‚Â¢ÃƒÆ’Ã†â€™Ãƒâ€ Ã¢â‚¬â„¢ÃƒÆ’Ã‚Â¢ÃƒÂ¢Ã¢â‚¬Å¡Ã‚Â¬Ãƒâ€šÃ‚Â ÃƒÆ’Ã†â€™Ãƒâ€šÃ‚Â¢ÃƒÆ’Ã‚Â¢ÃƒÂ¢Ã¢â€šÂ¬Ã…Â¡Ãƒâ€šÃ‚Â¬ÃƒÆ’Ã‚Â¢ÃƒÂ¢Ã¢â€šÂ¬Ã…Â¾Ãƒâ€šÃ‚Â¢ÃƒÆ’Ã†â€™Ãƒâ€ Ã¢â‚¬â„¢ÃƒÆ’Ã¢â‚¬Â ÃƒÂ¢Ã¢â€šÂ¬Ã¢â€žÂ¢ÃƒÆ’Ã†â€™Ãƒâ€šÃ‚Â¢ÃƒÆ’Ã‚Â¢ÃƒÂ¢Ã¢â€šÂ¬Ã…Â¡Ãƒâ€šÃ‚Â¬ÃƒÆ’Ã¢â‚¬Â¦Ãƒâ€šÃ‚Â¡ÃƒÆ’Ã†â€™Ãƒâ€ Ã¢â‚¬â„¢ÃƒÆ’Ã‚Â¢ÃƒÂ¢Ã¢â‚¬Å¡Ã‚Â¬Ãƒâ€¦Ã‚Â¡ÃƒÆ’Ã†â€™ÃƒÂ¢Ã¢â€šÂ¬Ã…Â¡ÃƒÆ’Ã¢â‚¬Å¡Ãƒâ€šÃ‚Â¢ÃƒÆ’Ã†â€™Ãƒâ€ Ã¢â‚¬â„¢ÃƒÆ’Ã¢â‚¬Â ÃƒÂ¢Ã¢â€šÂ¬Ã¢â€žÂ¢ÃƒÆ’Ã†â€™ÃƒÂ¢Ã¢â€šÂ¬Ã‚Â ÃƒÆ’Ã‚Â¢ÃƒÂ¢Ã¢â‚¬Å¡Ã‚Â¬ÃƒÂ¢Ã¢â‚¬Å¾Ã‚Â¢ÃƒÆ’Ã†â€™Ãƒâ€ Ã¢â‚¬â„¢ÃƒÆ’Ã‚Â¢ÃƒÂ¢Ã¢â‚¬Å¡Ã‚Â¬Ãƒâ€¦Ã‚Â¡ÃƒÆ’Ã†â€™ÃƒÂ¢Ã¢â€šÂ¬Ã…Â¡ÃƒÆ’Ã¢â‚¬Å¡Ãƒâ€šÃ‚Â¢ÃƒÆ’Ã†â€™Ãƒâ€ Ã¢â‚¬â„¢ÃƒÆ’Ã¢â‚¬Â ÃƒÂ¢Ã¢â€šÂ¬Ã¢â€žÂ¢ÃƒÆ’Ã†â€™ÃƒÂ¢Ã¢â€šÂ¬Ã…Â¡ÃƒÆ’Ã¢â‚¬Å¡Ãƒâ€šÃ‚Â¢ÃƒÆ’Ã†â€™Ãƒâ€ Ã¢â‚¬â„¢ÃƒÆ’Ã¢â‚¬Å¡Ãƒâ€šÃ‚Â¢ÃƒÆ’Ã†â€™Ãƒâ€šÃ‚Â¢ÃƒÆ’Ã‚Â¢ÃƒÂ¢Ã¢â€šÂ¬Ã…Â¡Ãƒâ€šÃ‚Â¬ÃƒÆ’Ã¢â‚¬Â¦Ãƒâ€šÃ‚Â¡ÃƒÆ’Ã†â€™ÃƒÂ¢Ã¢â€šÂ¬Ã…Â¡ÃƒÆ’Ã¢â‚¬Å¡Ãƒâ€šÃ‚Â¬ÃƒÆ’Ã†â€™Ãƒâ€ Ã¢â‚¬â„¢ÃƒÆ’Ã‚Â¢ÃƒÂ¢Ã¢â‚¬Å¡Ã‚Â¬Ãƒâ€šÃ‚Â¦ÃƒÆ’Ã†â€™ÃƒÂ¢Ã¢â€šÂ¬Ã…Â¡ÃƒÆ’Ã¢â‚¬Å¡Ãƒâ€šÃ‚Â¡ÃƒÆ’Ã†â€™Ãƒâ€ Ã¢â‚¬â„¢ÃƒÆ’Ã¢â‚¬Â ÃƒÂ¢Ã¢â€šÂ¬Ã¢â€žÂ¢ÃƒÆ’Ã†â€™Ãƒâ€šÃ‚Â¢ÃƒÆ’Ã‚Â¢ÃƒÂ¢Ã¢â€šÂ¬Ã…Â¡Ãƒâ€šÃ‚Â¬ÃƒÆ’Ã¢â‚¬Â¦Ãƒâ€šÃ‚Â¡ÃƒÆ’Ã†â€™Ãƒâ€ Ã¢â‚¬â„¢ÃƒÆ’Ã‚Â¢ÃƒÂ¢Ã¢â‚¬Å¡Ã‚Â¬Ãƒâ€¦Ã‚Â¡ÃƒÆ’Ã†â€™ÃƒÂ¢Ã¢â€šÂ¬Ã…Â¡ÃƒÆ’Ã¢â‚¬Å¡Ãƒâ€šÃ‚Â¬ÃƒÆ’Ã†â€™Ãƒâ€ Ã¢â‚¬â„¢ÃƒÆ’Ã¢â‚¬Â ÃƒÂ¢Ã¢â€šÂ¬Ã¢â€žÂ¢ÃƒÆ’Ã†â€™ÃƒÂ¢Ã¢â€šÂ¬Ã‚Â ÃƒÆ’Ã‚Â¢ÃƒÂ¢Ã¢â‚¬Å¡Ã‚Â¬ÃƒÂ¢Ã¢â‚¬Å¾Ã‚Â¢ÃƒÆ’Ã†â€™Ãƒâ€ Ã¢â‚¬â„¢ÃƒÆ’Ã¢â‚¬Å¡Ãƒâ€šÃ‚Â¢ÃƒÆ’Ã†â€™Ãƒâ€šÃ‚Â¢ÃƒÆ’Ã‚Â¢ÃƒÂ¢Ã¢â‚¬Å¡Ã‚Â¬Ãƒâ€¦Ã‚Â¡ÃƒÆ’Ã¢â‚¬Å¡Ãƒâ€šÃ‚Â¬ÃƒÆ’Ã†â€™ÃƒÂ¢Ã¢â€šÂ¬Ã…Â¡ÃƒÆ’Ã¢â‚¬Å¡Ãƒâ€šÃ‚Â¦ÃƒÆ’Ã†â€™Ãƒâ€ Ã¢â‚¬â„¢ÃƒÆ’Ã¢â‚¬Â ÃƒÂ¢Ã¢â€šÂ¬Ã¢â€žÂ¢ÃƒÆ’Ã†â€™ÃƒÂ¢Ã¢â€šÂ¬Ã…Â¡ÃƒÆ’Ã¢â‚¬Å¡Ãƒâ€šÃ‚Â¢ÃƒÆ’Ã†â€™Ãƒâ€ Ã¢â‚¬â„¢ÃƒÆ’Ã¢â‚¬Å¡Ãƒâ€šÃ‚Â¢ÃƒÆ’Ã†â€™Ãƒâ€šÃ‚Â¢ÃƒÆ’Ã‚Â¢ÃƒÂ¢Ã¢â€šÂ¬Ã…Â¡Ãƒâ€šÃ‚Â¬ÃƒÆ’Ã¢â‚¬Â¦Ãƒâ€šÃ‚Â¡ÃƒÆ’Ã†â€™ÃƒÂ¢Ã¢â€šÂ¬Ã…Â¡ÃƒÆ’Ã¢â‚¬Å¡Ãƒâ€šÃ‚Â¬ÃƒÆ’Ã†â€™Ãƒâ€ Ã¢â‚¬â„¢ÃƒÆ’Ã‚Â¢ÃƒÂ¢Ã¢â‚¬Å¡Ã‚Â¬Ãƒâ€šÃ‚Â¦ÃƒÆ’Ã†â€™Ãƒâ€šÃ‚Â¢ÃƒÆ’Ã‚Â¢ÃƒÂ¢Ã¢â€šÂ¬Ã…Â¡Ãƒâ€šÃ‚Â¬ÃƒÆ’Ã¢â‚¬Â¦ÃƒÂ¢Ã¢â€šÂ¬Ã…â€œ5), the salinity levels of both treatments briefly converged at about 21.5 ppt in Week 4. This was followed by a notable divergence in Week 5, where Monoculture salinity increased sharply to approximately 24.0 ppt, while the IMTA system </w:t>
+        <w:t>The line graph illustrates the weekly changes in salinity levels (measured in ppt) for Integrated Multi-Trophic Aquaculture (IMTA) and Monoculture treatments over a seven-week period. At the start of the study (Week 1), both treatments recorded identical salinity levels of approximately 20.6 ppt. During the early phase (Weeks 2ÃƒÆ’Ã†â€™Ãƒâ€ Ã¢â‚¬â„¢ÃƒÆ’Ã¢â‚¬Â ÃƒÂ¢Ã¢â€šÂ¬Ã¢â€žÂ¢ÃƒÆ’Ã†â€™ÃƒÂ¢Ã¢â€šÂ¬Ã‚Â ÃƒÆ’Ã‚Â¢ÃƒÂ¢Ã¢â‚¬Å¡Ã‚Â¬ÃƒÂ¢Ã¢â‚¬Å¾Ã‚Â¢ÃƒÆ’Ã†â€™Ãƒâ€ Ã¢â‚¬â„¢ÃƒÆ’Ã‚Â¢ÃƒÂ¢Ã¢â‚¬Å¡Ã‚Â¬Ãƒâ€šÃ‚Â ÃƒÆ’Ã†â€™Ãƒâ€šÃ‚Â¢ÃƒÆ’Ã‚Â¢ÃƒÂ¢Ã¢â€šÂ¬Ã…Â¡Ãƒâ€šÃ‚Â¬ÃƒÆ’Ã‚Â¢ÃƒÂ¢Ã¢â€šÂ¬Ã…Â¾Ãƒâ€šÃ‚Â¢ÃƒÆ’Ã†â€™Ãƒâ€ Ã¢â‚¬â„¢ÃƒÆ’Ã¢â‚¬Â ÃƒÂ¢Ã¢â€šÂ¬Ã¢â€žÂ¢ÃƒÆ’Ã†â€™Ãƒâ€šÃ‚Â¢ÃƒÆ’Ã‚Â¢ÃƒÂ¢Ã¢â€šÂ¬Ã…Â¡Ãƒâ€šÃ‚Â¬ÃƒÆ’Ã¢â‚¬Å¡Ãƒâ€šÃ‚Â ÃƒÆ’Ã†â€™Ãƒâ€ Ã¢â‚¬â„¢ÃƒÆ’Ã¢â‚¬Å¡Ãƒâ€šÃ‚Â¢ÃƒÆ’Ã†â€™Ãƒâ€šÃ‚Â¢ÃƒÆ’Ã‚Â¢ÃƒÂ¢Ã¢â‚¬Å¡Ã‚Â¬Ãƒâ€¦Ã‚Â¡ÃƒÆ’Ã¢â‚¬Å¡Ãƒâ€šÃ‚Â¬ÃƒÆ’Ã†â€™Ãƒâ€šÃ‚Â¢ÃƒÆ’Ã‚Â¢ÃƒÂ¢Ã¢â‚¬Å¡Ã‚Â¬Ãƒâ€¦Ã‚Â¾ÃƒÆ’Ã¢â‚¬Å¡Ãƒâ€šÃ‚Â¢ÃƒÆ’Ã†â€™Ãƒâ€ Ã¢â‚¬â„¢ÃƒÆ’Ã¢â‚¬Â ÃƒÂ¢Ã¢â€šÂ¬Ã¢â€žÂ¢ÃƒÆ’Ã†â€™ÃƒÂ¢Ã¢â€šÂ¬Ã‚Â ÃƒÆ’Ã‚Â¢ÃƒÂ¢Ã¢â‚¬Å¡Ã‚Â¬ÃƒÂ¢Ã¢â‚¬Å¾Ã‚Â¢ÃƒÆ’Ã†â€™Ãƒâ€ Ã¢â‚¬â„¢ÃƒÆ’Ã¢â‚¬Å¡Ãƒâ€šÃ‚Â¢ÃƒÆ’Ã†â€™Ãƒâ€šÃ‚Â¢ÃƒÆ’Ã‚Â¢ÃƒÂ¢Ã¢â‚¬Å¡Ã‚Â¬Ãƒâ€¦Ã‚Â¡ÃƒÆ’Ã¢â‚¬Å¡Ãƒâ€šÃ‚Â¬ÃƒÆ’Ã†â€™ÃƒÂ¢Ã¢â€šÂ¬Ã…Â¡ÃƒÆ’Ã¢â‚¬Å¡Ãƒâ€šÃ‚Â ÃƒÆ’Ã†â€™Ãƒâ€ Ã¢â‚¬â„¢ÃƒÆ’Ã¢â‚¬Â ÃƒÂ¢Ã¢â€šÂ¬Ã¢â€žÂ¢ÃƒÆ’Ã†â€™ÃƒÂ¢Ã¢â€šÂ¬Ã…Â¡ÃƒÆ’Ã¢â‚¬Å¡Ãƒâ€šÃ‚Â¢ÃƒÆ’Ã†â€™Ãƒâ€ Ã¢â‚¬â„¢ÃƒÆ’Ã¢â‚¬Å¡Ãƒâ€šÃ‚Â¢ÃƒÆ’Ã†â€™Ãƒâ€šÃ‚Â¢ÃƒÆ’Ã‚Â¢ÃƒÂ¢Ã¢â€šÂ¬Ã…Â¡Ãƒâ€šÃ‚Â¬ÃƒÆ’Ã¢â‚¬Â¦Ãƒâ€šÃ‚Â¡ÃƒÆ’Ã†â€™ÃƒÂ¢Ã¢â€šÂ¬Ã…Â¡ÃƒÆ’Ã¢â‚¬Å¡Ãƒâ€šÃ‚Â¬ÃƒÆ’Ã†â€™Ãƒâ€ Ã¢â‚¬â„¢ÃƒÆ’Ã¢â‚¬Å¡Ãƒâ€šÃ‚Â¢ÃƒÆ’Ã†â€™Ãƒâ€šÃ‚Â¢ÃƒÆ’Ã‚Â¢ÃƒÂ¢Ã¢â€šÂ¬Ã…Â¡Ãƒâ€šÃ‚Â¬ÃƒÆ’Ã¢â‚¬Â¦Ãƒâ€šÃ‚Â¾ÃƒÆ’Ã†â€™ÃƒÂ¢Ã¢â€šÂ¬Ã…Â¡ÃƒÆ’Ã¢â‚¬Å¡Ãƒâ€šÃ‚Â¢ÃƒÆ’Ã†â€™Ãƒâ€ Ã¢â‚¬â„¢ÃƒÆ’Ã¢â‚¬Â ÃƒÂ¢Ã¢â€šÂ¬Ã¢â€žÂ¢ÃƒÆ’Ã†â€™ÃƒÂ¢Ã¢â€šÂ¬Ã‚Â ÃƒÆ’Ã‚Â¢ÃƒÂ¢Ã¢â‚¬Å¡Ã‚Â¬ÃƒÂ¢Ã¢â‚¬Å¾Ã‚Â¢ÃƒÆ’Ã†â€™Ãƒâ€ Ã¢â‚¬â„¢ÃƒÆ’Ã‚Â¢ÃƒÂ¢Ã¢â‚¬Å¡Ã‚Â¬Ãƒâ€šÃ‚Â ÃƒÆ’Ã†â€™Ãƒâ€šÃ‚Â¢ÃƒÆ’Ã‚Â¢ÃƒÂ¢Ã¢â€šÂ¬Ã…Â¡Ãƒâ€šÃ‚Â¬ÃƒÆ’Ã‚Â¢ÃƒÂ¢Ã¢â€šÂ¬Ã…Â¾Ãƒâ€šÃ‚Â¢ÃƒÆ’Ã†â€™Ãƒâ€ Ã¢â‚¬â„¢ÃƒÆ’Ã¢â‚¬Â ÃƒÂ¢Ã¢â€šÂ¬Ã¢â€žÂ¢ÃƒÆ’Ã†â€™ÃƒÂ¢Ã¢â€šÂ¬Ã…Â¡ÃƒÆ’Ã¢â‚¬Å¡Ãƒâ€šÃ‚Â¢ÃƒÆ’Ã†â€™Ãƒâ€ Ã¢â‚¬â„¢ÃƒÆ’Ã¢â‚¬Å¡Ãƒâ€šÃ‚Â¢ÃƒÆ’Ã†â€™Ãƒâ€šÃ‚Â¢ÃƒÆ’Ã‚Â¢ÃƒÂ¢Ã¢â€šÂ¬Ã…Â¡Ãƒâ€šÃ‚Â¬ÃƒÆ’Ã¢â‚¬Â¦Ãƒâ€šÃ‚Â¡ÃƒÆ’Ã†â€™ÃƒÂ¢Ã¢â€šÂ¬Ã…Â¡ÃƒÆ’Ã¢â‚¬Å¡Ãƒâ€šÃ‚Â¬ÃƒÆ’Ã†â€™Ãƒâ€ Ã¢â‚¬â„¢ÃƒÆ’Ã‚Â¢ÃƒÂ¢Ã¢â‚¬Å¡Ã‚Â¬Ãƒâ€šÃ‚Â¦ÃƒÆ’Ã†â€™ÃƒÂ¢Ã¢â€šÂ¬Ã…Â¡ÃƒÆ’Ã¢â‚¬Å¡Ãƒâ€šÃ‚Â¡ÃƒÆ’Ã†â€™Ãƒâ€ Ã¢â‚¬â„¢ÃƒÆ’Ã¢â‚¬Â ÃƒÂ¢Ã¢â€šÂ¬Ã¢â€žÂ¢ÃƒÆ’Ã†â€™ÃƒÂ¢Ã¢â€šÂ¬Ã‚Â ÃƒÆ’Ã‚Â¢ÃƒÂ¢Ã¢â‚¬Å¡Ã‚Â¬ÃƒÂ¢Ã¢â‚¬Å¾Ã‚Â¢ÃƒÆ’Ã†â€™Ãƒâ€ Ã¢â‚¬â„¢ÃƒÆ’Ã¢â‚¬Å¡Ãƒâ€šÃ‚Â¢ÃƒÆ’Ã†â€™Ãƒâ€šÃ‚Â¢ÃƒÆ’Ã‚Â¢ÃƒÂ¢Ã¢â‚¬Å¡Ã‚Â¬Ãƒâ€¦Ã‚Â¡ÃƒÆ’Ã¢â‚¬Å¡Ãƒâ€šÃ‚Â¬ÃƒÆ’Ã†â€™ÃƒÂ¢Ã¢â€šÂ¬Ã‚Â¦ÃƒÆ’Ã¢â‚¬Å¡Ãƒâ€šÃ‚Â¡ÃƒÆ’Ã†â€™Ãƒâ€ Ã¢â‚¬â„¢ÃƒÆ’Ã¢â‚¬Â ÃƒÂ¢Ã¢â€šÂ¬Ã¢â€žÂ¢ÃƒÆ’Ã†â€™Ãƒâ€šÃ‚Â¢ÃƒÆ’Ã‚Â¢ÃƒÂ¢Ã¢â€šÂ¬Ã…Â¡Ãƒâ€šÃ‚Â¬ÃƒÆ’Ã¢â‚¬Â¦Ãƒâ€šÃ‚Â¡ÃƒÆ’Ã†â€™Ãƒâ€ Ã¢â‚¬â„¢ÃƒÆ’Ã‚Â¢ÃƒÂ¢Ã¢â‚¬Å¡Ã‚Â¬Ãƒâ€¦Ã‚Â¡ÃƒÆ’Ã†â€™ÃƒÂ¢Ã¢â€šÂ¬Ã…Â¡ÃƒÆ’Ã¢â‚¬Å¡Ãƒâ€šÃ‚Â¢ÃƒÆ’Ã†â€™Ãƒâ€ Ã¢â‚¬â„¢ÃƒÆ’Ã¢â‚¬Â ÃƒÂ¢Ã¢â€šÂ¬Ã¢â€žÂ¢ÃƒÆ’Ã†â€™ÃƒÂ¢Ã¢â€šÂ¬Ã‚Â ÃƒÆ’Ã‚Â¢ÃƒÂ¢Ã¢â‚¬Å¡Ã‚Â¬ÃƒÂ¢Ã¢â‚¬Å¾Ã‚Â¢ÃƒÆ’Ã†â€™Ãƒâ€ Ã¢â‚¬â„¢ÃƒÆ’Ã‚Â¢ÃƒÂ¢Ã¢â‚¬Å¡Ã‚Â¬Ãƒâ€šÃ‚Â ÃƒÆ’Ã†â€™Ãƒâ€šÃ‚Â¢ÃƒÆ’Ã‚Â¢ÃƒÂ¢Ã¢â€šÂ¬Ã…Â¡Ãƒâ€šÃ‚Â¬ÃƒÆ’Ã‚Â¢ÃƒÂ¢Ã¢â€šÂ¬Ã…Â¾Ãƒâ€šÃ‚Â¢ÃƒÆ’Ã†â€™Ãƒâ€ Ã¢â‚¬â„¢ÃƒÆ’Ã¢â‚¬Â ÃƒÂ¢Ã¢â€šÂ¬Ã¢â€žÂ¢ÃƒÆ’Ã†â€™Ãƒâ€šÃ‚Â¢ÃƒÆ’Ã‚Â¢ÃƒÂ¢Ã¢â€šÂ¬Ã…Â¡Ãƒâ€šÃ‚Â¬ÃƒÆ’Ã¢â‚¬Å¡Ãƒâ€šÃ‚Â ÃƒÆ’Ã†â€™Ãƒâ€ Ã¢â‚¬â„¢ÃƒÆ’Ã¢â‚¬Å¡Ãƒâ€šÃ‚Â¢ÃƒÆ’Ã†â€™Ãƒâ€šÃ‚Â¢ÃƒÆ’Ã‚Â¢ÃƒÂ¢Ã¢â‚¬Å¡Ã‚Â¬Ãƒâ€¦Ã‚Â¡ÃƒÆ’Ã¢â‚¬Å¡Ãƒâ€šÃ‚Â¬ÃƒÆ’Ã†â€™Ãƒâ€šÃ‚Â¢ÃƒÆ’Ã‚Â¢ÃƒÂ¢Ã¢â‚¬Å¡Ã‚Â¬Ãƒâ€¦Ã‚Â¾ÃƒÆ’Ã¢â‚¬Å¡Ãƒâ€šÃ‚Â¢ÃƒÆ’Ã†â€™Ãƒâ€ Ã¢â‚¬â„¢ÃƒÆ’Ã¢â‚¬Â ÃƒÂ¢Ã¢â€šÂ¬Ã¢â€žÂ¢ÃƒÆ’Ã†â€™ÃƒÂ¢Ã¢â€šÂ¬Ã‚Â ÃƒÆ’Ã‚Â¢ÃƒÂ¢Ã¢â‚¬Å¡Ã‚Â¬ÃƒÂ¢Ã¢â‚¬Å¾Ã‚Â¢ÃƒÆ’Ã†â€™Ãƒâ€ Ã¢â‚¬â„¢ÃƒÆ’Ã¢â‚¬Å¡Ãƒâ€šÃ‚Â¢ÃƒÆ’Ã†â€™Ãƒâ€šÃ‚Â¢ÃƒÆ’Ã‚Â¢ÃƒÂ¢Ã¢â‚¬Å¡Ã‚Â¬Ãƒâ€¦Ã‚Â¡ÃƒÆ’Ã¢â‚¬Å¡Ãƒâ€šÃ‚Â¬ÃƒÆ’Ã†â€™ÃƒÂ¢Ã¢â€šÂ¬Ã‚Â¦ÃƒÆ’Ã¢â‚¬Å¡Ãƒâ€šÃ‚Â¡ÃƒÆ’Ã†â€™Ãƒâ€ Ã¢â‚¬â„¢ÃƒÆ’Ã¢â‚¬Â ÃƒÂ¢Ã¢â€šÂ¬Ã¢â€žÂ¢ÃƒÆ’Ã†â€™Ãƒâ€šÃ‚Â¢ÃƒÆ’Ã‚Â¢ÃƒÂ¢Ã¢â€šÂ¬Ã…Â¡Ãƒâ€šÃ‚Â¬ÃƒÆ’Ã¢â‚¬Â¦Ãƒâ€šÃ‚Â¡ÃƒÆ’Ã†â€™Ãƒâ€ Ã¢â‚¬â„¢ÃƒÆ’Ã‚Â¢ÃƒÂ¢Ã¢â‚¬Å¡Ã‚Â¬Ãƒâ€¦Ã‚Â¡ÃƒÆ’Ã†â€™ÃƒÂ¢Ã¢â€šÂ¬Ã…Â¡ÃƒÆ’Ã¢â‚¬Å¡Ãƒâ€šÃ‚Â¢ÃƒÆ’Ã†â€™Ãƒâ€ Ã¢â‚¬â„¢ÃƒÆ’Ã¢â‚¬Â ÃƒÂ¢Ã¢â€šÂ¬Ã¢â€žÂ¢ÃƒÆ’Ã†â€™ÃƒÂ¢Ã¢â€šÂ¬Ã‚Â ÃƒÆ’Ã‚Â¢ÃƒÂ¢Ã¢â‚¬Å¡Ã‚Â¬ÃƒÂ¢Ã¢â‚¬Å¾Ã‚Â¢ÃƒÆ’Ã†â€™Ãƒâ€ Ã¢â‚¬â„¢ÃƒÆ’Ã‚Â¢ÃƒÂ¢Ã¢â‚¬Å¡Ã‚Â¬Ãƒâ€šÃ‚Â ÃƒÆ’Ã†â€™Ãƒâ€šÃ‚Â¢ÃƒÆ’Ã‚Â¢ÃƒÂ¢Ã¢â€šÂ¬Ã…Â¡Ãƒâ€šÃ‚Â¬ÃƒÆ’Ã‚Â¢ÃƒÂ¢Ã¢â€šÂ¬Ã…Â¾Ãƒâ€šÃ‚Â¢ÃƒÆ’Ã†â€™Ãƒâ€ Ã¢â‚¬â„¢ÃƒÆ’Ã¢â‚¬Â ÃƒÂ¢Ã¢â€šÂ¬Ã¢â€žÂ¢ÃƒÆ’Ã†â€™Ãƒâ€šÃ‚Â¢ÃƒÆ’Ã‚Â¢ÃƒÂ¢Ã¢â€šÂ¬Ã…Â¡Ãƒâ€šÃ‚Â¬ÃƒÆ’Ã¢â‚¬Â¦Ãƒâ€šÃ‚Â¡ÃƒÆ’Ã†â€™Ãƒâ€ Ã¢â‚¬â„¢ÃƒÆ’Ã‚Â¢ÃƒÂ¢Ã¢â‚¬Å¡Ã‚Â¬Ãƒâ€¦Ã‚Â¡ÃƒÆ’Ã†â€™ÃƒÂ¢Ã¢â€šÂ¬Ã…Â¡ÃƒÆ’Ã¢â‚¬Å¡Ãƒâ€šÃ‚Â¢ÃƒÆ’Ã†â€™Ãƒâ€ Ã¢â‚¬â„¢ÃƒÆ’Ã¢â‚¬Â ÃƒÂ¢Ã¢â€šÂ¬Ã¢â€žÂ¢ÃƒÆ’Ã†â€™ÃƒÂ¢Ã¢â€šÂ¬Ã‚Â ÃƒÆ’Ã‚Â¢ÃƒÂ¢Ã¢â‚¬Å¡Ã‚Â¬ÃƒÂ¢Ã¢â‚¬Å¾Ã‚Â¢ÃƒÆ’Ã†â€™Ãƒâ€ Ã¢â‚¬â„¢ÃƒÆ’Ã‚Â¢ÃƒÂ¢Ã¢â‚¬Å¡Ã‚Â¬Ãƒâ€¦Ã‚Â¡ÃƒÆ’Ã†â€™ÃƒÂ¢Ã¢â€šÂ¬Ã…Â¡ÃƒÆ’Ã¢â‚¬Å¡Ãƒâ€šÃ‚Â¢ÃƒÆ’Ã†â€™Ãƒâ€ Ã¢â‚¬â„¢ÃƒÆ’Ã¢â‚¬Â ÃƒÂ¢Ã¢â€šÂ¬Ã¢â€žÂ¢ÃƒÆ’Ã†â€™ÃƒÂ¢Ã¢â€šÂ¬Ã…Â¡ÃƒÆ’Ã¢â‚¬Å¡Ãƒâ€šÃ‚Â¢ÃƒÆ’Ã†â€™Ãƒâ€ Ã¢â‚¬â„¢ÃƒÆ’Ã¢â‚¬Å¡Ãƒâ€šÃ‚Â¢ÃƒÆ’Ã†â€™Ãƒâ€šÃ‚Â¢ÃƒÆ’Ã‚Â¢ÃƒÂ¢Ã¢â€šÂ¬Ã…Â¡Ãƒâ€šÃ‚Â¬ÃƒÆ’Ã¢â‚¬Â¦Ãƒâ€šÃ‚Â¡ÃƒÆ’Ã†â€™ÃƒÂ¢Ã¢â€šÂ¬Ã…Â¡ÃƒÆ’Ã¢â‚¬Å¡Ãƒâ€šÃ‚Â¬ÃƒÆ’Ã†â€™Ãƒâ€ Ã¢â‚¬â„¢ÃƒÆ’Ã‚Â¢ÃƒÂ¢Ã¢â‚¬Å¡Ã‚Â¬Ãƒâ€šÃ‚Â¦ÃƒÆ’Ã†â€™ÃƒÂ¢Ã¢â€šÂ¬Ã…Â¡ÃƒÆ’Ã¢â‚¬Å¡Ãƒâ€šÃ‚Â¡ÃƒÆ’Ã†â€™Ãƒâ€ Ã¢â‚¬â„¢ÃƒÆ’Ã¢â‚¬Â ÃƒÂ¢Ã¢â€šÂ¬Ã¢â€žÂ¢ÃƒÆ’Ã†â€™Ãƒâ€šÃ‚Â¢ÃƒÆ’Ã‚Â¢ÃƒÂ¢Ã¢â€šÂ¬Ã…Â¡Ãƒâ€šÃ‚Â¬ÃƒÆ’Ã¢â‚¬Â¦Ãƒâ€šÃ‚Â¡ÃƒÆ’Ã†â€™Ãƒâ€ Ã¢â‚¬â„¢ÃƒÆ’Ã‚Â¢ÃƒÂ¢Ã¢â‚¬Å¡Ã‚Â¬Ãƒâ€¦Ã‚Â¡ÃƒÆ’Ã†â€™ÃƒÂ¢Ã¢â€šÂ¬Ã…Â¡ÃƒÆ’Ã¢â‚¬Å¡Ãƒâ€šÃ‚Â¬ÃƒÆ’Ã†â€™Ãƒâ€ Ã¢â‚¬â„¢ÃƒÆ’Ã¢â‚¬Â ÃƒÂ¢Ã¢â€šÂ¬Ã¢â€žÂ¢ÃƒÆ’Ã†â€™ÃƒÂ¢Ã¢â€šÂ¬Ã‚Â ÃƒÆ’Ã‚Â¢ÃƒÂ¢Ã¢â‚¬Å¡Ã‚Â¬ÃƒÂ¢Ã¢â‚¬Å¾Ã‚Â¢ÃƒÆ’Ã†â€™Ãƒâ€ Ã¢â‚¬â„¢ÃƒÆ’Ã¢â‚¬Å¡Ãƒâ€šÃ‚Â¢ÃƒÆ’Ã†â€™Ãƒâ€šÃ‚Â¢ÃƒÆ’Ã‚Â¢ÃƒÂ¢Ã¢â‚¬Å¡Ã‚Â¬Ãƒâ€¦Ã‚Â¡ÃƒÆ’Ã¢â‚¬Å¡Ãƒâ€šÃ‚Â¬ÃƒÆ’Ã†â€™ÃƒÂ¢Ã¢â€šÂ¬Ã…Â¡ÃƒÆ’Ã¢â‚¬Å¡Ãƒâ€šÃ‚Â¦ÃƒÆ’Ã†â€™Ãƒâ€ Ã¢â‚¬â„¢ÃƒÆ’Ã¢â‚¬Â ÃƒÂ¢Ã¢â€šÂ¬Ã¢â€žÂ¢ÃƒÆ’Ã†â€™Ãƒâ€šÃ‚Â¢ÃƒÆ’Ã‚Â¢ÃƒÂ¢Ã¢â€šÂ¬Ã…Â¡Ãƒâ€šÃ‚Â¬ÃƒÆ’Ã¢â‚¬Â¦Ãƒâ€šÃ‚Â¡ÃƒÆ’Ã†â€™Ãƒâ€ Ã¢â‚¬â„¢ÃƒÆ’Ã‚Â¢ÃƒÂ¢Ã¢â‚¬Å¡Ã‚Â¬Ãƒâ€¦Ã‚Â¡ÃƒÆ’Ã†â€™ÃƒÂ¢Ã¢â€šÂ¬Ã…Â¡ÃƒÆ’Ã¢â‚¬Å¡Ãƒâ€šÃ‚Â¡ÃƒÆ’Ã†â€™Ãƒâ€ Ã¢â‚¬â„¢ÃƒÆ’Ã¢â‚¬Â ÃƒÂ¢Ã¢â€šÂ¬Ã¢â€žÂ¢ÃƒÆ’Ã†â€™ÃƒÂ¢Ã¢â€šÂ¬Ã‚Â ÃƒÆ’Ã‚Â¢ÃƒÂ¢Ã¢â‚¬Å¡Ã‚Â¬ÃƒÂ¢Ã¢â‚¬Å¾Ã‚Â¢ÃƒÆ’Ã†â€™Ãƒâ€ Ã¢â‚¬â„¢ÃƒÆ’Ã‚Â¢ÃƒÂ¢Ã¢â‚¬Å¡Ã‚Â¬Ãƒâ€šÃ‚Â ÃƒÆ’Ã†â€™Ãƒâ€šÃ‚Â¢ÃƒÆ’Ã‚Â¢ÃƒÂ¢Ã¢â€šÂ¬Ã…Â¡Ãƒâ€šÃ‚Â¬ÃƒÆ’Ã‚Â¢ÃƒÂ¢Ã¢â€šÂ¬Ã…Â¾Ãƒâ€šÃ‚Â¢ÃƒÆ’Ã†â€™Ãƒâ€ Ã¢â‚¬â„¢ÃƒÆ’Ã¢â‚¬Â ÃƒÂ¢Ã¢â€šÂ¬Ã¢â€žÂ¢ÃƒÆ’Ã†â€™ÃƒÂ¢Ã¢â€šÂ¬Ã…Â¡ÃƒÆ’Ã¢â‚¬Å¡Ãƒâ€šÃ‚Â¢ÃƒÆ’Ã†â€™Ãƒâ€ Ã¢â‚¬â„¢ÃƒÆ’Ã¢â‚¬Å¡Ãƒâ€šÃ‚Â¢ÃƒÆ’Ã†â€™Ãƒâ€šÃ‚Â¢ÃƒÆ’Ã‚Â¢ÃƒÂ¢Ã¢â€šÂ¬Ã…Â¡Ãƒâ€šÃ‚Â¬ÃƒÆ’Ã¢â‚¬Â¦Ãƒâ€šÃ‚Â¡ÃƒÆ’Ã†â€™ÃƒÂ¢Ã¢â€šÂ¬Ã…Â¡ÃƒÆ’Ã¢â‚¬Å¡Ãƒâ€šÃ‚Â¬ÃƒÆ’Ã†â€™Ãƒâ€ Ã¢â‚¬â„¢ÃƒÆ’Ã‚Â¢ÃƒÂ¢Ã¢â‚¬Å¡Ã‚Â¬Ãƒâ€šÃ‚Â¦ÃƒÆ’Ã†â€™ÃƒÂ¢Ã¢â€šÂ¬Ã…Â¡ÃƒÆ’Ã¢â‚¬Å¡Ãƒâ€šÃ‚Â¡ÃƒÆ’Ã†â€™Ãƒâ€ Ã¢â‚¬â„¢ÃƒÆ’Ã¢â‚¬Â ÃƒÂ¢Ã¢â€šÂ¬Ã¢â€žÂ¢ÃƒÆ’Ã†â€™ÃƒÂ¢Ã¢â€šÂ¬Ã‚Â ÃƒÆ’Ã‚Â¢ÃƒÂ¢Ã¢â‚¬Å¡Ã‚Â¬ÃƒÂ¢Ã¢â‚¬Å¾Ã‚Â¢ÃƒÆ’Ã†â€™Ãƒâ€ Ã¢â‚¬â„¢ÃƒÆ’Ã¢â‚¬Å¡Ãƒâ€šÃ‚Â¢ÃƒÆ’Ã†â€™Ãƒâ€šÃ‚Â¢ÃƒÆ’Ã‚Â¢ÃƒÂ¢Ã¢â‚¬Å¡Ã‚Â¬Ãƒâ€¦Ã‚Â¡ÃƒÆ’Ã¢â‚¬Å¡Ãƒâ€šÃ‚Â¬ÃƒÆ’Ã†â€™ÃƒÂ¢Ã¢â€šÂ¬Ã‚Â¦ÃƒÆ’Ã¢â‚¬Å¡Ãƒâ€šÃ‚Â¡ÃƒÆ’Ã†â€™Ãƒâ€ Ã¢â‚¬â„¢ÃƒÆ’Ã¢â‚¬Â ÃƒÂ¢Ã¢â€šÂ¬Ã¢â€žÂ¢ÃƒÆ’Ã†â€™Ãƒâ€šÃ‚Â¢ÃƒÆ’Ã‚Â¢ÃƒÂ¢Ã¢â€šÂ¬Ã…Â¡Ãƒâ€šÃ‚Â¬ÃƒÆ’Ã¢â‚¬Â¦Ãƒâ€šÃ‚Â¡ÃƒÆ’Ã†â€™Ãƒâ€ Ã¢â‚¬â„¢ÃƒÆ’Ã‚Â¢ÃƒÂ¢Ã¢â‚¬Å¡Ã‚Â¬Ãƒâ€¦Ã‚Â¡ÃƒÆ’Ã†â€™ÃƒÂ¢Ã¢â€šÂ¬Ã…Â¡ÃƒÆ’Ã¢â‚¬Å¡Ãƒâ€šÃ‚Â¬ÃƒÆ’Ã†â€™Ãƒâ€ Ã¢â‚¬â„¢ÃƒÆ’Ã¢â‚¬Â ÃƒÂ¢Ã¢â€šÂ¬Ã¢â€žÂ¢ÃƒÆ’Ã†â€™ÃƒÂ¢Ã¢â€šÂ¬Ã‚Â ÃƒÆ’Ã‚Â¢ÃƒÂ¢Ã¢â‚¬Å¡Ã‚Â¬ÃƒÂ¢Ã¢â‚¬Å¾Ã‚Â¢ÃƒÆ’Ã†â€™Ãƒâ€ Ã¢â‚¬â„¢ÃƒÆ’Ã‚Â¢ÃƒÂ¢Ã¢â‚¬Å¡Ã‚Â¬Ãƒâ€šÃ‚Â ÃƒÆ’Ã†â€™Ãƒâ€šÃ‚Â¢ÃƒÆ’Ã‚Â¢ÃƒÂ¢Ã¢â€šÂ¬Ã…Â¡Ãƒâ€šÃ‚Â¬ÃƒÆ’Ã‚Â¢ÃƒÂ¢Ã¢â€šÂ¬Ã…Â¾Ãƒâ€šÃ‚Â¢ÃƒÆ’Ã†â€™Ãƒâ€ Ã¢â‚¬â„¢ÃƒÆ’Ã¢â‚¬Â ÃƒÂ¢Ã¢â€šÂ¬Ã¢â€žÂ¢ÃƒÆ’Ã†â€™Ãƒâ€šÃ‚Â¢ÃƒÆ’Ã‚Â¢ÃƒÂ¢Ã¢â€šÂ¬Ã…Â¡Ãƒâ€šÃ‚Â¬ÃƒÆ’Ã¢â‚¬Å¡Ãƒâ€šÃ‚Â ÃƒÆ’Ã†â€™Ãƒâ€ Ã¢â‚¬â„¢ÃƒÆ’Ã¢â‚¬Å¡Ãƒâ€šÃ‚Â¢ÃƒÆ’Ã†â€™Ãƒâ€šÃ‚Â¢ÃƒÆ’Ã‚Â¢ÃƒÂ¢Ã¢â‚¬Å¡Ã‚Â¬Ãƒâ€¦Ã‚Â¡ÃƒÆ’Ã¢â‚¬Å¡Ãƒâ€šÃ‚Â¬ÃƒÆ’Ã†â€™Ãƒâ€šÃ‚Â¢ÃƒÆ’Ã‚Â¢ÃƒÂ¢Ã¢â‚¬Å¡Ã‚Â¬Ãƒâ€¦Ã‚Â¾ÃƒÆ’Ã¢â‚¬Å¡Ãƒâ€šÃ‚Â¢ÃƒÆ’Ã†â€™Ãƒâ€ Ã¢â‚¬â„¢ÃƒÆ’Ã¢â‚¬Â ÃƒÂ¢Ã¢â€šÂ¬Ã¢â€žÂ¢ÃƒÆ’Ã†â€™ÃƒÂ¢Ã¢â€šÂ¬Ã‚Â ÃƒÆ’Ã‚Â¢ÃƒÂ¢Ã¢â‚¬Å¡Ã‚Â¬ÃƒÂ¢Ã¢â‚¬Å¾Ã‚Â¢ÃƒÆ’Ã†â€™Ãƒâ€ Ã¢â‚¬â„¢ÃƒÆ’Ã¢â‚¬Å¡Ãƒâ€šÃ‚Â¢ÃƒÆ’Ã†â€™Ãƒâ€šÃ‚Â¢ÃƒÆ’Ã‚Â¢ÃƒÂ¢Ã¢â‚¬Å¡Ã‚Â¬Ãƒâ€¦Ã‚Â¡ÃƒÆ’Ã¢â‚¬Å¡Ãƒâ€šÃ‚Â¬ÃƒÆ’Ã†â€™ÃƒÂ¢Ã¢â€šÂ¬Ã‚Â¦ÃƒÆ’Ã¢â‚¬Å¡Ãƒâ€šÃ‚Â¡ÃƒÆ’Ã†â€™Ãƒâ€ Ã¢â‚¬â„¢ÃƒÆ’Ã¢â‚¬Â ÃƒÂ¢Ã¢â€šÂ¬Ã¢â€žÂ¢ÃƒÆ’Ã†â€™Ãƒâ€šÃ‚Â¢ÃƒÆ’Ã‚Â¢ÃƒÂ¢Ã¢â€šÂ¬Ã…Â¡Ãƒâ€šÃ‚Â¬ÃƒÆ’Ã¢â‚¬Â¦Ãƒâ€šÃ‚Â¡ÃƒÆ’Ã†â€™Ãƒâ€ Ã¢â‚¬â„¢ÃƒÆ’Ã‚Â¢ÃƒÂ¢Ã¢â‚¬Å¡Ã‚Â¬Ãƒâ€¦Ã‚Â¡ÃƒÆ’Ã†â€™ÃƒÂ¢Ã¢â€šÂ¬Ã…Â¡ÃƒÆ’Ã¢â‚¬Å¡Ãƒâ€šÃ‚Â¢ÃƒÆ’Ã†â€™Ãƒâ€ Ã¢â‚¬â„¢ÃƒÆ’Ã¢â‚¬Â ÃƒÂ¢Ã¢â€šÂ¬Ã¢â€žÂ¢ÃƒÆ’Ã†â€™ÃƒÂ¢Ã¢â€šÂ¬Ã‚Â ÃƒÆ’Ã‚Â¢ÃƒÂ¢Ã¢â‚¬Å¡Ã‚Â¬ÃƒÂ¢Ã¢â‚¬Å¾Ã‚Â¢ÃƒÆ’Ã†â€™Ãƒâ€ Ã¢â‚¬â„¢ÃƒÆ’Ã‚Â¢ÃƒÂ¢Ã¢â‚¬Å¡Ã‚Â¬Ãƒâ€šÃ‚Â ÃƒÆ’Ã†â€™Ãƒâ€šÃ‚Â¢ÃƒÆ’Ã‚Â¢ÃƒÂ¢Ã¢â€šÂ¬Ã…Â¡Ãƒâ€šÃ‚Â¬ÃƒÆ’Ã‚Â¢ÃƒÂ¢Ã¢â€šÂ¬Ã…Â¾Ãƒâ€šÃ‚Â¢ÃƒÆ’Ã†â€™Ãƒâ€ Ã¢â‚¬â„¢ÃƒÆ’Ã¢â‚¬Â ÃƒÂ¢Ã¢â€šÂ¬Ã¢â€žÂ¢ÃƒÆ’Ã†â€™Ãƒâ€šÃ‚Â¢ÃƒÆ’Ã‚Â¢ÃƒÂ¢Ã¢â€šÂ¬Ã…Â¡Ãƒâ€šÃ‚Â¬ÃƒÆ’Ã¢â‚¬Â¦Ãƒâ€šÃ‚Â¡ÃƒÆ’Ã†â€™Ãƒâ€ Ã¢â‚¬â„¢ÃƒÆ’Ã‚Â¢ÃƒÂ¢Ã¢â‚¬Å¡Ã‚Â¬Ãƒâ€¦Ã‚Â¡ÃƒÆ’Ã†â€™ÃƒÂ¢Ã¢â€šÂ¬Ã…Â¡ÃƒÆ’Ã¢â‚¬Å¡Ãƒâ€šÃ‚Â¢ÃƒÆ’Ã†â€™Ãƒâ€ Ã¢â‚¬â„¢ÃƒÆ’Ã¢â‚¬Â ÃƒÂ¢Ã¢â€šÂ¬Ã¢â€žÂ¢ÃƒÆ’Ã†â€™ÃƒÂ¢Ã¢â€šÂ¬Ã‚Â ÃƒÆ’Ã‚Â¢ÃƒÂ¢Ã¢â‚¬Å¡Ã‚Â¬ÃƒÂ¢Ã¢â‚¬Å¾Ã‚Â¢ÃƒÆ’Ã†â€™Ãƒâ€ Ã¢â‚¬â„¢ÃƒÆ’Ã‚Â¢ÃƒÂ¢Ã¢â‚¬Å¡Ã‚Â¬Ãƒâ€¦Ã‚Â¡ÃƒÆ’Ã†â€™ÃƒÂ¢Ã¢â€šÂ¬Ã…Â¡ÃƒÆ’Ã¢â‚¬Å¡Ãƒâ€šÃ‚Â¢ÃƒÆ’Ã†â€™Ãƒâ€ Ã¢â‚¬â„¢ÃƒÆ’Ã¢â‚¬Â ÃƒÂ¢Ã¢â€šÂ¬Ã¢â€žÂ¢ÃƒÆ’Ã†â€™ÃƒÂ¢Ã¢â€šÂ¬Ã…Â¡ÃƒÆ’Ã¢â‚¬Å¡Ãƒâ€šÃ‚Â¢ÃƒÆ’Ã†â€™Ãƒâ€ Ã¢â‚¬â„¢ÃƒÆ’Ã¢â‚¬Å¡Ãƒâ€šÃ‚Â¢ÃƒÆ’Ã†â€™Ãƒâ€šÃ‚Â¢ÃƒÆ’Ã‚Â¢ÃƒÂ¢Ã¢â‚¬Å¡Ã‚Â¬Ãƒâ€¦Ã‚Â¡ÃƒÆ’Ã¢â‚¬Å¡Ãƒâ€šÃ‚Â¬ÃƒÆ’Ã†â€™ÃƒÂ¢Ã¢â€šÂ¬Ã‚Â¦ÃƒÆ’Ã¢â‚¬Å¡Ãƒâ€šÃ‚Â¡ÃƒÆ’Ã†â€™Ãƒâ€ Ã¢â‚¬â„¢ÃƒÆ’Ã‚Â¢ÃƒÂ¢Ã¢â‚¬Å¡Ã‚Â¬Ãƒâ€¦Ã‚Â¡ÃƒÆ’Ã†â€™ÃƒÂ¢Ã¢â€šÂ¬Ã…Â¡ÃƒÆ’Ã¢â‚¬Å¡Ãƒâ€šÃ‚Â¬ÃƒÆ’Ã†â€™Ãƒâ€ Ã¢â‚¬â„¢ÃƒÆ’Ã¢â‚¬Â ÃƒÂ¢Ã¢â€šÂ¬Ã¢â€žÂ¢ÃƒÆ’Ã†â€™Ãƒâ€šÃ‚Â¢ÃƒÆ’Ã‚Â¢ÃƒÂ¢Ã¢â€šÂ¬Ã…Â¡Ãƒâ€šÃ‚Â¬ÃƒÆ’Ã¢â‚¬Å¡Ãƒâ€šÃ‚Â¦ÃƒÆ’Ã†â€™Ãƒâ€ Ã¢â‚¬â„¢ÃƒÆ’Ã‚Â¢ÃƒÂ¢Ã¢â‚¬Å¡Ã‚Â¬Ãƒâ€¦Ã‚Â¡ÃƒÆ’Ã†â€™ÃƒÂ¢Ã¢â€šÂ¬Ã…Â¡ÃƒÆ’Ã¢â‚¬Å¡Ãƒâ€šÃ‚Â¡ÃƒÆ’Ã†â€™Ãƒâ€ Ã¢â‚¬â„¢ÃƒÆ’Ã¢â‚¬Â ÃƒÂ¢Ã¢â€šÂ¬Ã¢â€žÂ¢ÃƒÆ’Ã†â€™ÃƒÂ¢Ã¢â€šÂ¬Ã‚Â ÃƒÆ’Ã‚Â¢ÃƒÂ¢Ã¢â‚¬Å¡Ã‚Â¬ÃƒÂ¢Ã¢â‚¬Å¾Ã‚Â¢ÃƒÆ’Ã†â€™Ãƒâ€ Ã¢â‚¬â„¢ÃƒÆ’Ã¢â‚¬Å¡Ãƒâ€šÃ‚Â¢ÃƒÆ’Ã†â€™Ãƒâ€šÃ‚Â¢ÃƒÆ’Ã‚Â¢ÃƒÂ¢Ã¢â‚¬Å¡Ã‚Â¬Ãƒâ€¦Ã‚Â¡ÃƒÆ’Ã¢â‚¬Å¡Ãƒâ€šÃ‚Â¬ÃƒÆ’Ã†â€™ÃƒÂ¢Ã¢â€šÂ¬Ã‚Â¦ÃƒÆ’Ã¢â‚¬Å¡Ãƒâ€šÃ‚Â¡ÃƒÆ’Ã†â€™Ãƒâ€ Ã¢â‚¬â„¢ÃƒÆ’Ã¢â‚¬Â ÃƒÂ¢Ã¢â€šÂ¬Ã¢â€žÂ¢ÃƒÆ’Ã†â€™Ãƒâ€šÃ‚Â¢ÃƒÆ’Ã‚Â¢ÃƒÂ¢Ã¢â€šÂ¬Ã…Â¡Ãƒâ€šÃ‚Â¬ÃƒÆ’Ã¢â‚¬Â¦Ãƒâ€šÃ‚Â¡ÃƒÆ’Ã†â€™Ãƒâ€ Ã¢â‚¬â„¢ÃƒÆ’Ã‚Â¢ÃƒÂ¢Ã¢â‚¬Å¡Ã‚Â¬Ãƒâ€¦Ã‚Â¡ÃƒÆ’Ã†â€™ÃƒÂ¢Ã¢â€šÂ¬Ã…Â¡ÃƒÆ’Ã¢â‚¬Å¡Ãƒâ€šÃ‚Â¬ÃƒÆ’Ã†â€™Ãƒâ€ Ã¢â‚¬â„¢ÃƒÆ’Ã¢â‚¬Â ÃƒÂ¢Ã¢â€šÂ¬Ã¢â€žÂ¢ÃƒÆ’Ã†â€™ÃƒÂ¢Ã¢â€šÂ¬Ã‚Â ÃƒÆ’Ã‚Â¢ÃƒÂ¢Ã¢â‚¬Å¡Ã‚Â¬ÃƒÂ¢Ã¢â‚¬Å¾Ã‚Â¢ÃƒÆ’Ã†â€™Ãƒâ€ Ã¢â‚¬â„¢ÃƒÆ’Ã‚Â¢ÃƒÂ¢Ã¢â‚¬Å¡Ã‚Â¬Ãƒâ€šÃ‚Â ÃƒÆ’Ã†â€™Ãƒâ€šÃ‚Â¢ÃƒÆ’Ã‚Â¢ÃƒÂ¢Ã¢â€šÂ¬Ã…Â¡Ãƒâ€šÃ‚Â¬ÃƒÆ’Ã‚Â¢ÃƒÂ¢Ã¢â€šÂ¬Ã…Â¾Ãƒâ€šÃ‚Â¢ÃƒÆ’Ã†â€™Ãƒâ€ Ã¢â‚¬â„¢ÃƒÆ’Ã¢â‚¬Â ÃƒÂ¢Ã¢â€šÂ¬Ã¢â€žÂ¢ÃƒÆ’Ã†â€™ÃƒÂ¢Ã¢â€šÂ¬Ã…Â¡ÃƒÆ’Ã¢â‚¬Å¡Ãƒâ€šÃ‚Â¢ÃƒÆ’Ã†â€™Ãƒâ€ Ã¢â‚¬â„¢ÃƒÆ’Ã¢â‚¬Å¡Ãƒâ€šÃ‚Â¢ÃƒÆ’Ã†â€™Ãƒâ€šÃ‚Â¢ÃƒÆ’Ã‚Â¢ÃƒÂ¢Ã¢â€šÂ¬Ã…Â¡Ãƒâ€šÃ‚Â¬ÃƒÆ’Ã¢â‚¬Â¦Ãƒâ€šÃ‚Â¡ÃƒÆ’Ã†â€™ÃƒÂ¢Ã¢â€šÂ¬Ã…Â¡ÃƒÆ’Ã¢â‚¬Å¡Ãƒâ€šÃ‚Â¬ÃƒÆ’Ã†â€™Ãƒâ€ Ã¢â‚¬â„¢ÃƒÆ’Ã‚Â¢ÃƒÂ¢Ã¢â‚¬Å¡Ã‚Â¬Ãƒâ€¦Ã‚Â¡ÃƒÆ’Ã†â€™ÃƒÂ¢Ã¢â€šÂ¬Ã…Â¡ÃƒÆ’Ã¢â‚¬Å¡Ãƒâ€šÃ‚Â¦ÃƒÆ’Ã†â€™Ãƒâ€ Ã¢â‚¬â„¢ÃƒÆ’Ã¢â‚¬Â ÃƒÂ¢Ã¢â€šÂ¬Ã¢â€žÂ¢ÃƒÆ’Ã†â€™ÃƒÂ¢Ã¢â€šÂ¬Ã‚Â ÃƒÆ’Ã‚Â¢ÃƒÂ¢Ã¢â‚¬Å¡Ã‚Â¬ÃƒÂ¢Ã¢â‚¬Å¾Ã‚Â¢ÃƒÆ’Ã†â€™Ãƒâ€ Ã¢â‚¬â„¢ÃƒÆ’Ã‚Â¢ÃƒÂ¢Ã¢â‚¬Å¡Ã‚Â¬Ãƒâ€¦Ã‚Â¡ÃƒÆ’Ã†â€™ÃƒÂ¢Ã¢â€šÂ¬Ã…Â¡ÃƒÆ’Ã¢â‚¬Å¡Ãƒâ€šÃ‚Â¢ÃƒÆ’Ã†â€™Ãƒâ€ Ã¢â‚¬â„¢ÃƒÆ’Ã¢â‚¬Â ÃƒÂ¢Ã¢â€šÂ¬Ã¢â€žÂ¢ÃƒÆ’Ã†â€™ÃƒÂ¢Ã¢â€šÂ¬Ã…Â¡ÃƒÆ’Ã¢â‚¬Å¡Ãƒâ€šÃ‚Â¢ÃƒÆ’Ã†â€™Ãƒâ€ Ã¢â‚¬â„¢ÃƒÆ’Ã¢â‚¬Å¡Ãƒâ€šÃ‚Â¢ÃƒÆ’Ã†â€™Ãƒâ€šÃ‚Â¢ÃƒÆ’Ã‚Â¢ÃƒÂ¢Ã¢â‚¬Å¡Ã‚Â¬Ãƒâ€¦Ã‚Â¡ÃƒÆ’Ã¢â‚¬Å¡Ãƒâ€šÃ‚Â¬ÃƒÆ’Ã†â€™ÃƒÂ¢Ã¢â€šÂ¬Ã‚Â¦ÃƒÆ’Ã¢â‚¬Å¡Ãƒâ€šÃ‚Â¡ÃƒÆ’Ã†â€™Ãƒâ€ Ã¢â‚¬â„¢ÃƒÆ’Ã‚Â¢ÃƒÂ¢Ã¢â‚¬Å¡Ã‚Â¬Ãƒâ€¦Ã‚Â¡ÃƒÆ’Ã†â€™ÃƒÂ¢Ã¢â€šÂ¬Ã…Â¡ÃƒÆ’Ã¢â‚¬Å¡Ãƒâ€šÃ‚Â¬ÃƒÆ’Ã†â€™Ãƒâ€ Ã¢â‚¬â„¢ÃƒÆ’Ã¢â‚¬Â ÃƒÂ¢Ã¢â€šÂ¬Ã¢â€žÂ¢ÃƒÆ’Ã†â€™Ãƒâ€šÃ‚Â¢ÃƒÆ’Ã‚Â¢ÃƒÂ¢Ã¢â€šÂ¬Ã…Â¡Ãƒâ€šÃ‚Â¬ÃƒÆ’Ã¢â‚¬Å¡Ãƒâ€šÃ‚Â¦ÃƒÆ’Ã†â€™Ãƒâ€ Ã¢â‚¬â„¢ÃƒÆ’Ã¢â‚¬Å¡Ãƒâ€šÃ‚Â¢ÃƒÆ’Ã†â€™Ãƒâ€šÃ‚Â¢ÃƒÆ’Ã‚Â¢ÃƒÂ¢Ã¢â‚¬Å¡Ã‚Â¬Ãƒâ€¦Ã‚Â¡ÃƒÆ’Ã¢â‚¬Å¡Ãƒâ€šÃ‚Â¬ÃƒÆ’Ã†â€™ÃƒÂ¢Ã¢â€šÂ¬Ã‚Â¦ÃƒÆ’Ã‚Â¢ÃƒÂ¢Ã¢â‚¬Å¡Ã‚Â¬Ãƒâ€¦Ã¢â‚¬Å“3), salinity increased in both systems; however, the Monoculture treatment consistently showed higher values (around 23.5 ppt) compared to the IMTA system (approximately 22.9 ppt).</w:t>
+      </w:r>
+    </w:p>
+    <w:p>
+      <w:pPr>
+        <w:spacing w:line="360" w:lineRule="auto"/>
+        <w:rPr>
+          <w:rFonts w:ascii="Times New Roman" w:hAnsi="Times New Roman" w:cs="Times New Roman"/>
+        </w:rPr>
+      </w:pPr>
+      <w:r>
+        <w:rPr>
+          <w:rFonts w:ascii="Times New Roman" w:hAnsi="Times New Roman" w:cs="Times New Roman"/>
+        </w:rPr>
+        <w:t xml:space="preserve">In the mid-phase of the study (Weeks 4ÃƒÆ’Ã†â€™Ãƒâ€ Ã¢â‚¬â„¢ÃƒÆ’Ã¢â‚¬Â ÃƒÂ¢Ã¢â€šÂ¬Ã¢â€žÂ¢ÃƒÆ’Ã†â€™ÃƒÂ¢Ã¢â€šÂ¬Ã‚Â ÃƒÆ’Ã‚Â¢ÃƒÂ¢Ã¢â‚¬Å¡Ã‚Â¬ÃƒÂ¢Ã¢â‚¬Å¾Ã‚Â¢ÃƒÆ’Ã†â€™Ãƒâ€ Ã¢â‚¬â„¢ÃƒÆ’Ã‚Â¢ÃƒÂ¢Ã¢â‚¬Å¡Ã‚Â¬Ãƒâ€šÃ‚Â ÃƒÆ’Ã†â€™Ãƒâ€šÃ‚Â¢ÃƒÆ’Ã‚Â¢ÃƒÂ¢Ã¢â€šÂ¬Ã…Â¡Ãƒâ€šÃ‚Â¬ÃƒÆ’Ã‚Â¢ÃƒÂ¢Ã¢â€šÂ¬Ã…Â¾Ãƒâ€šÃ‚Â¢ÃƒÆ’Ã†â€™Ãƒâ€ Ã¢â‚¬â„¢ÃƒÆ’Ã¢â‚¬Â ÃƒÂ¢Ã¢â€šÂ¬Ã¢â€žÂ¢ÃƒÆ’Ã†â€™Ãƒâ€šÃ‚Â¢ÃƒÆ’Ã‚Â¢ÃƒÂ¢Ã¢â€šÂ¬Ã…Â¡Ãƒâ€šÃ‚Â¬ÃƒÆ’Ã¢â‚¬Å¡Ãƒâ€šÃ‚Â ÃƒÆ’Ã†â€™Ãƒâ€ Ã¢â‚¬â„¢ÃƒÆ’Ã¢â‚¬Å¡Ãƒâ€šÃ‚Â¢ÃƒÆ’Ã†â€™Ãƒâ€šÃ‚Â¢ÃƒÆ’Ã‚Â¢ÃƒÂ¢Ã¢â‚¬Å¡Ã‚Â¬Ãƒâ€¦Ã‚Â¡ÃƒÆ’Ã¢â‚¬Å¡Ãƒâ€šÃ‚Â¬ÃƒÆ’Ã†â€™Ãƒâ€šÃ‚Â¢ÃƒÆ’Ã‚Â¢ÃƒÂ¢Ã¢â‚¬Å¡Ã‚Â¬Ãƒâ€¦Ã‚Â¾ÃƒÆ’Ã¢â‚¬Å¡Ãƒâ€šÃ‚Â¢ÃƒÆ’Ã†â€™Ãƒâ€ Ã¢â‚¬â„¢ÃƒÆ’Ã¢â‚¬Â ÃƒÂ¢Ã¢â€šÂ¬Ã¢â€žÂ¢ÃƒÆ’Ã†â€™ÃƒÂ¢Ã¢â€šÂ¬Ã‚Â ÃƒÆ’Ã‚Â¢ÃƒÂ¢Ã¢â‚¬Å¡Ã‚Â¬ÃƒÂ¢Ã¢â‚¬Å¾Ã‚Â¢ÃƒÆ’Ã†â€™Ãƒâ€ Ã¢â‚¬â„¢ÃƒÆ’Ã¢â‚¬Å¡Ãƒâ€šÃ‚Â¢ÃƒÆ’Ã†â€™Ãƒâ€šÃ‚Â¢ÃƒÆ’Ã‚Â¢ÃƒÂ¢Ã¢â‚¬Å¡Ã‚Â¬Ãƒâ€¦Ã‚Â¡ÃƒÆ’Ã¢â‚¬Å¡Ãƒâ€šÃ‚Â¬ÃƒÆ’Ã†â€™ÃƒÂ¢Ã¢â€šÂ¬Ã…Â¡ÃƒÆ’Ã¢â‚¬Å¡Ãƒâ€šÃ‚Â ÃƒÆ’Ã†â€™Ãƒâ€ Ã¢â‚¬â„¢ÃƒÆ’Ã¢â‚¬Â ÃƒÂ¢Ã¢â€šÂ¬Ã¢â€žÂ¢ÃƒÆ’Ã†â€™ÃƒÂ¢Ã¢â€šÂ¬Ã…Â¡ÃƒÆ’Ã¢â‚¬Å¡Ãƒâ€šÃ‚Â¢ÃƒÆ’Ã†â€™Ãƒâ€ Ã¢â‚¬â„¢ÃƒÆ’Ã¢â‚¬Å¡Ãƒâ€šÃ‚Â¢ÃƒÆ’Ã†â€™Ãƒâ€šÃ‚Â¢ÃƒÆ’Ã‚Â¢ÃƒÂ¢Ã¢â€šÂ¬Ã…Â¡Ãƒâ€šÃ‚Â¬ÃƒÆ’Ã¢â‚¬Â¦Ãƒâ€šÃ‚Â¡ÃƒÆ’Ã†â€™ÃƒÂ¢Ã¢â€šÂ¬Ã…Â¡ÃƒÆ’Ã¢â‚¬Å¡Ãƒâ€šÃ‚Â¬ÃƒÆ’Ã†â€™Ãƒâ€ Ã¢â‚¬â„¢ÃƒÆ’Ã¢â‚¬Å¡Ãƒâ€šÃ‚Â¢ÃƒÆ’Ã†â€™Ãƒâ€šÃ‚Â¢ÃƒÆ’Ã‚Â¢ÃƒÂ¢Ã¢â€šÂ¬Ã…Â¡Ãƒâ€šÃ‚Â¬ÃƒÆ’Ã¢â‚¬Â¦Ãƒâ€šÃ‚Â¾ÃƒÆ’Ã†â€™ÃƒÂ¢Ã¢â€šÂ¬Ã…Â¡ÃƒÆ’Ã¢â‚¬Å¡Ãƒâ€šÃ‚Â¢ÃƒÆ’Ã†â€™Ãƒâ€ Ã¢â‚¬â„¢ÃƒÆ’Ã¢â‚¬Â ÃƒÂ¢Ã¢â€šÂ¬Ã¢â€žÂ¢ÃƒÆ’Ã†â€™ÃƒÂ¢Ã¢â€šÂ¬Ã‚Â ÃƒÆ’Ã‚Â¢ÃƒÂ¢Ã¢â‚¬Å¡Ã‚Â¬ÃƒÂ¢Ã¢â‚¬Å¾Ã‚Â¢ÃƒÆ’Ã†â€™Ãƒâ€ Ã¢â‚¬â„¢ÃƒÆ’Ã‚Â¢ÃƒÂ¢Ã¢â‚¬Å¡Ã‚Â¬Ãƒâ€šÃ‚Â ÃƒÆ’Ã†â€™Ãƒâ€šÃ‚Â¢ÃƒÆ’Ã‚Â¢ÃƒÂ¢Ã¢â€šÂ¬Ã…Â¡Ãƒâ€šÃ‚Â¬ÃƒÆ’Ã‚Â¢ÃƒÂ¢Ã¢â€šÂ¬Ã…Â¾Ãƒâ€šÃ‚Â¢ÃƒÆ’Ã†â€™Ãƒâ€ Ã¢â‚¬â„¢ÃƒÆ’Ã¢â‚¬Â ÃƒÂ¢Ã¢â€šÂ¬Ã¢â€žÂ¢ÃƒÆ’Ã†â€™ÃƒÂ¢Ã¢â€šÂ¬Ã…Â¡ÃƒÆ’Ã¢â‚¬Å¡Ãƒâ€šÃ‚Â¢ÃƒÆ’Ã†â€™Ãƒâ€ Ã¢â‚¬â„¢ÃƒÆ’Ã¢â‚¬Å¡Ãƒâ€šÃ‚Â¢ÃƒÆ’Ã†â€™Ãƒâ€šÃ‚Â¢ÃƒÆ’Ã‚Â¢ÃƒÂ¢Ã¢â€šÂ¬Ã…Â¡Ãƒâ€šÃ‚Â¬ÃƒÆ’Ã¢â‚¬Â¦Ãƒâ€šÃ‚Â¡ÃƒÆ’Ã†â€™ÃƒÂ¢Ã¢â€šÂ¬Ã…Â¡ÃƒÆ’Ã¢â‚¬Å¡Ãƒâ€šÃ‚Â¬ÃƒÆ’Ã†â€™Ãƒâ€ Ã¢â‚¬â„¢ÃƒÆ’Ã‚Â¢ÃƒÂ¢Ã¢â‚¬Å¡Ã‚Â¬Ãƒâ€šÃ‚Â¦ÃƒÆ’Ã†â€™ÃƒÂ¢Ã¢â€šÂ¬Ã…Â¡ÃƒÆ’Ã¢â‚¬Å¡Ãƒâ€šÃ‚Â¡ÃƒÆ’Ã†â€™Ãƒâ€ Ã¢â‚¬â„¢ÃƒÆ’Ã¢â‚¬Â ÃƒÂ¢Ã¢â€šÂ¬Ã¢â€žÂ¢ÃƒÆ’Ã†â€™ÃƒÂ¢Ã¢â€šÂ¬Ã‚Â ÃƒÆ’Ã‚Â¢ÃƒÂ¢Ã¢â‚¬Å¡Ã‚Â¬ÃƒÂ¢Ã¢â‚¬Å¾Ã‚Â¢ÃƒÆ’Ã†â€™Ãƒâ€ Ã¢â‚¬â„¢ÃƒÆ’Ã¢â‚¬Å¡Ãƒâ€šÃ‚Â¢ÃƒÆ’Ã†â€™Ãƒâ€šÃ‚Â¢ÃƒÆ’Ã‚Â¢ÃƒÂ¢Ã¢â‚¬Å¡Ã‚Â¬Ãƒâ€¦Ã‚Â¡ÃƒÆ’Ã¢â‚¬Å¡Ãƒâ€šÃ‚Â¬ÃƒÆ’Ã†â€™ÃƒÂ¢Ã¢â€šÂ¬Ã‚Â¦ÃƒÆ’Ã¢â‚¬Å¡Ãƒâ€šÃ‚Â¡ÃƒÆ’Ã†â€™Ãƒâ€ Ã¢â‚¬â„¢ÃƒÆ’Ã¢â‚¬Â ÃƒÂ¢Ã¢â€šÂ¬Ã¢â€žÂ¢ÃƒÆ’Ã†â€™Ãƒâ€šÃ‚Â¢ÃƒÆ’Ã‚Â¢ÃƒÂ¢Ã¢â€šÂ¬Ã…Â¡Ãƒâ€šÃ‚Â¬ÃƒÆ’Ã¢â‚¬Â¦Ãƒâ€šÃ‚Â¡ÃƒÆ’Ã†â€™Ãƒâ€ Ã¢â‚¬â„¢ÃƒÆ’Ã‚Â¢ÃƒÂ¢Ã¢â‚¬Å¡Ã‚Â¬Ãƒâ€¦Ã‚Â¡ÃƒÆ’Ã†â€™ÃƒÂ¢Ã¢â€šÂ¬Ã…Â¡ÃƒÆ’Ã¢â‚¬Å¡Ãƒâ€šÃ‚Â¢ÃƒÆ’Ã†â€™Ãƒâ€ Ã¢â‚¬â„¢ÃƒÆ’Ã¢â‚¬Â ÃƒÂ¢Ã¢â€šÂ¬Ã¢â€žÂ¢ÃƒÆ’Ã†â€™ÃƒÂ¢Ã¢â€šÂ¬Ã‚Â ÃƒÆ’Ã‚Â¢ÃƒÂ¢Ã¢â‚¬Å¡Ã‚Â¬ÃƒÂ¢Ã¢â‚¬Å¾Ã‚Â¢ÃƒÆ’Ã†â€™Ãƒâ€ Ã¢â‚¬â„¢ÃƒÆ’Ã‚Â¢ÃƒÂ¢Ã¢â‚¬Å¡Ã‚Â¬Ãƒâ€šÃ‚Â ÃƒÆ’Ã†â€™Ãƒâ€šÃ‚Â¢ÃƒÆ’Ã‚Â¢ÃƒÂ¢Ã¢â€šÂ¬Ã…Â¡Ãƒâ€šÃ‚Â¬ÃƒÆ’Ã‚Â¢ÃƒÂ¢Ã¢â€šÂ¬Ã…Â¾Ãƒâ€šÃ‚Â¢ÃƒÆ’Ã†â€™Ãƒâ€ Ã¢â‚¬â„¢ÃƒÆ’Ã¢â‚¬Â ÃƒÂ¢Ã¢â€šÂ¬Ã¢â€žÂ¢ÃƒÆ’Ã†â€™Ãƒâ€šÃ‚Â¢ÃƒÆ’Ã‚Â¢ÃƒÂ¢Ã¢â€šÂ¬Ã…Â¡Ãƒâ€šÃ‚Â¬ÃƒÆ’Ã¢â‚¬Å¡Ãƒâ€šÃ‚Â ÃƒÆ’Ã†â€™Ãƒâ€ Ã¢â‚¬â„¢ÃƒÆ’Ã¢â‚¬Å¡Ãƒâ€šÃ‚Â¢ÃƒÆ’Ã†â€™Ãƒâ€šÃ‚Â¢ÃƒÆ’Ã‚Â¢ÃƒÂ¢Ã¢â‚¬Å¡Ã‚Â¬Ãƒâ€¦Ã‚Â¡ÃƒÆ’Ã¢â‚¬Å¡Ãƒâ€šÃ‚Â¬ÃƒÆ’Ã†â€™Ãƒâ€šÃ‚Â¢ÃƒÆ’Ã‚Â¢ÃƒÂ¢Ã¢â‚¬Å¡Ã‚Â¬Ãƒâ€¦Ã‚Â¾ÃƒÆ’Ã¢â‚¬Å¡Ãƒâ€šÃ‚Â¢ÃƒÆ’Ã†â€™Ãƒâ€ Ã¢â‚¬â„¢ÃƒÆ’Ã¢â‚¬Â ÃƒÂ¢Ã¢â€šÂ¬Ã¢â€žÂ¢ÃƒÆ’Ã†â€™ÃƒÂ¢Ã¢â€šÂ¬Ã‚Â ÃƒÆ’Ã‚Â¢ÃƒÂ¢Ã¢â‚¬Å¡Ã‚Â¬ÃƒÂ¢Ã¢â‚¬Å¾Ã‚Â¢ÃƒÆ’Ã†â€™Ãƒâ€ Ã¢â‚¬â„¢ÃƒÆ’Ã¢â‚¬Å¡Ãƒâ€šÃ‚Â¢ÃƒÆ’Ã†â€™Ãƒâ€šÃ‚Â¢ÃƒÆ’Ã‚Â¢ÃƒÂ¢Ã¢â‚¬Å¡Ã‚Â¬Ãƒâ€¦Ã‚Â¡ÃƒÆ’Ã¢â‚¬Å¡Ãƒâ€šÃ‚Â¬ÃƒÆ’Ã†â€™ÃƒÂ¢Ã¢â€šÂ¬Ã‚Â¦ÃƒÆ’Ã¢â‚¬Å¡Ãƒâ€šÃ‚Â¡ÃƒÆ’Ã†â€™Ãƒâ€ Ã¢â‚¬â„¢ÃƒÆ’Ã¢â‚¬Â ÃƒÂ¢Ã¢â€šÂ¬Ã¢â€žÂ¢ÃƒÆ’Ã†â€™Ãƒâ€šÃ‚Â¢ÃƒÆ’Ã‚Â¢ÃƒÂ¢Ã¢â€šÂ¬Ã…Â¡Ãƒâ€šÃ‚Â¬ÃƒÆ’Ã¢â‚¬Â¦Ãƒâ€šÃ‚Â¡ÃƒÆ’Ã†â€™Ãƒâ€ Ã¢â‚¬â„¢ÃƒÆ’Ã‚Â¢ÃƒÂ¢Ã¢â‚¬Å¡Ã‚Â¬Ãƒâ€¦Ã‚Â¡ÃƒÆ’Ã†â€™ÃƒÂ¢Ã¢â€šÂ¬Ã…Â¡ÃƒÆ’Ã¢â‚¬Å¡Ãƒâ€šÃ‚Â¢ÃƒÆ’Ã†â€™Ãƒâ€ Ã¢â‚¬â„¢ÃƒÆ’Ã¢â‚¬Â ÃƒÂ¢Ã¢â€šÂ¬Ã¢â€žÂ¢ÃƒÆ’Ã†â€™ÃƒÂ¢Ã¢â€šÂ¬Ã‚Â ÃƒÆ’Ã‚Â¢ÃƒÂ¢Ã¢â‚¬Å¡Ã‚Â¬ÃƒÂ¢Ã¢â‚¬Å¾Ã‚Â¢ÃƒÆ’Ã†â€™Ãƒâ€ Ã¢â‚¬â„¢ÃƒÆ’Ã‚Â¢ÃƒÂ¢Ã¢â‚¬Å¡Ã‚Â¬Ãƒâ€šÃ‚Â ÃƒÆ’Ã†â€™Ãƒâ€šÃ‚Â¢ÃƒÆ’Ã‚Â¢ÃƒÂ¢Ã¢â€šÂ¬Ã…Â¡Ãƒâ€šÃ‚Â¬ÃƒÆ’Ã‚Â¢ÃƒÂ¢Ã¢â€šÂ¬Ã…Â¾Ãƒâ€šÃ‚Â¢ÃƒÆ’Ã†â€™Ãƒâ€ Ã¢â‚¬â„¢ÃƒÆ’Ã¢â‚¬Â ÃƒÂ¢Ã¢â€šÂ¬Ã¢â€žÂ¢ÃƒÆ’Ã†â€™Ãƒâ€šÃ‚Â¢ÃƒÆ’Ã‚Â¢ÃƒÂ¢Ã¢â€šÂ¬Ã…Â¡Ãƒâ€šÃ‚Â¬ÃƒÆ’Ã¢â‚¬Â¦Ãƒâ€šÃ‚Â¡ÃƒÆ’Ã†â€™Ãƒâ€ Ã¢â‚¬â„¢ÃƒÆ’Ã‚Â¢ÃƒÂ¢Ã¢â‚¬Å¡Ã‚Â¬Ãƒâ€¦Ã‚Â¡ÃƒÆ’Ã†â€™ÃƒÂ¢Ã¢â€šÂ¬Ã…Â¡ÃƒÆ’Ã¢â‚¬Å¡Ãƒâ€šÃ‚Â¢ÃƒÆ’Ã†â€™Ãƒâ€ Ã¢â‚¬â„¢ÃƒÆ’Ã¢â‚¬Â ÃƒÂ¢Ã¢â€šÂ¬Ã¢â€žÂ¢ÃƒÆ’Ã†â€™ÃƒÂ¢Ã¢â€šÂ¬Ã‚Â ÃƒÆ’Ã‚Â¢ÃƒÂ¢Ã¢â‚¬Å¡Ã‚Â¬ÃƒÂ¢Ã¢â‚¬Å¾Ã‚Â¢ÃƒÆ’Ã†â€™Ãƒâ€ Ã¢â‚¬â„¢ÃƒÆ’Ã‚Â¢ÃƒÂ¢Ã¢â‚¬Å¡Ã‚Â¬Ãƒâ€¦Ã‚Â¡ÃƒÆ’Ã†â€™ÃƒÂ¢Ã¢â€šÂ¬Ã…Â¡ÃƒÆ’Ã¢â‚¬Å¡Ãƒâ€šÃ‚Â¢ÃƒÆ’Ã†â€™Ãƒâ€ Ã¢â‚¬â„¢ÃƒÆ’Ã¢â‚¬Â ÃƒÂ¢Ã¢â€šÂ¬Ã¢â€žÂ¢ÃƒÆ’Ã†â€™ÃƒÂ¢Ã¢â€šÂ¬Ã…Â¡ÃƒÆ’Ã¢â‚¬Å¡Ãƒâ€šÃ‚Â¢ÃƒÆ’Ã†â€™Ãƒâ€ Ã¢â‚¬â„¢ÃƒÆ’Ã¢â‚¬Å¡Ãƒâ€šÃ‚Â¢ÃƒÆ’Ã†â€™Ãƒâ€šÃ‚Â¢ÃƒÆ’Ã‚Â¢ÃƒÂ¢Ã¢â€šÂ¬Ã…Â¡Ãƒâ€šÃ‚Â¬ÃƒÆ’Ã¢â‚¬Â¦Ãƒâ€šÃ‚Â¡ÃƒÆ’Ã†â€™ÃƒÂ¢Ã¢â€šÂ¬Ã…Â¡ÃƒÆ’Ã¢â‚¬Å¡Ãƒâ€šÃ‚Â¬ÃƒÆ’Ã†â€™Ãƒâ€ Ã¢â‚¬â„¢ÃƒÆ’Ã‚Â¢ÃƒÂ¢Ã¢â‚¬Å¡Ã‚Â¬Ãƒâ€šÃ‚Â¦ÃƒÆ’Ã†â€™ÃƒÂ¢Ã¢â€šÂ¬Ã…Â¡ÃƒÆ’Ã¢â‚¬Å¡Ãƒâ€šÃ‚Â¡ÃƒÆ’Ã†â€™Ãƒâ€ Ã¢â‚¬â„¢ÃƒÆ’Ã¢â‚¬Â ÃƒÂ¢Ã¢â€šÂ¬Ã¢â€žÂ¢ÃƒÆ’Ã†â€™Ãƒâ€šÃ‚Â¢ÃƒÆ’Ã‚Â¢ÃƒÂ¢Ã¢â€šÂ¬Ã…Â¡Ãƒâ€šÃ‚Â¬ÃƒÆ’Ã¢â‚¬Â¦Ãƒâ€šÃ‚Â¡ÃƒÆ’Ã†â€™Ãƒâ€ Ã¢â‚¬â„¢ÃƒÆ’Ã‚Â¢ÃƒÂ¢Ã¢â‚¬Å¡Ã‚Â¬Ãƒâ€¦Ã‚Â¡ÃƒÆ’Ã†â€™ÃƒÂ¢Ã¢â€šÂ¬Ã…Â¡ÃƒÆ’Ã¢â‚¬Å¡Ãƒâ€šÃ‚Â¬ÃƒÆ’Ã†â€™Ãƒâ€ Ã¢â‚¬â„¢ÃƒÆ’Ã¢â‚¬Â ÃƒÂ¢Ã¢â€šÂ¬Ã¢â€žÂ¢ÃƒÆ’Ã†â€™ÃƒÂ¢Ã¢â€šÂ¬Ã‚Â ÃƒÆ’Ã‚Â¢ÃƒÂ¢Ã¢â‚¬Å¡Ã‚Â¬ÃƒÂ¢Ã¢â‚¬Å¾Ã‚Â¢ÃƒÆ’Ã†â€™Ãƒâ€ Ã¢â‚¬â„¢ÃƒÆ’Ã¢â‚¬Å¡Ãƒâ€šÃ‚Â¢ÃƒÆ’Ã†â€™Ãƒâ€šÃ‚Â¢ÃƒÆ’Ã‚Â¢ÃƒÂ¢Ã¢â‚¬Å¡Ã‚Â¬Ãƒâ€¦Ã‚Â¡ÃƒÆ’Ã¢â‚¬Å¡Ãƒâ€šÃ‚Â¬ÃƒÆ’Ã†â€™ÃƒÂ¢Ã¢â€šÂ¬Ã…Â¡ÃƒÆ’Ã¢â‚¬Å¡Ãƒâ€šÃ‚Â¦ÃƒÆ’Ã†â€™Ãƒâ€ Ã¢â‚¬â„¢ÃƒÆ’Ã¢â‚¬Â ÃƒÂ¢Ã¢â€šÂ¬Ã¢â€žÂ¢ÃƒÆ’Ã†â€™Ãƒâ€šÃ‚Â¢ÃƒÆ’Ã‚Â¢ÃƒÂ¢Ã¢â€šÂ¬Ã…Â¡Ãƒâ€šÃ‚Â¬ÃƒÆ’Ã¢â‚¬Â¦Ãƒâ€šÃ‚Â¡ÃƒÆ’Ã†â€™Ãƒâ€ Ã¢â‚¬â„¢ÃƒÆ’Ã‚Â¢ÃƒÂ¢Ã¢â‚¬Å¡Ã‚Â¬Ãƒâ€¦Ã‚Â¡ÃƒÆ’Ã†â€™ÃƒÂ¢Ã¢â€šÂ¬Ã…Â¡ÃƒÆ’Ã¢â‚¬Å¡Ãƒâ€šÃ‚Â¡ÃƒÆ’Ã†â€™Ãƒâ€ Ã¢â‚¬â„¢ÃƒÆ’Ã¢â‚¬Â ÃƒÂ¢Ã¢â€šÂ¬Ã¢â€žÂ¢ÃƒÆ’Ã†â€™ÃƒÂ¢Ã¢â€šÂ¬Ã‚Â ÃƒÆ’Ã‚Â¢ÃƒÂ¢Ã¢â‚¬Å¡Ã‚Â¬ÃƒÂ¢Ã¢â‚¬Å¾Ã‚Â¢ÃƒÆ’Ã†â€™Ãƒâ€ Ã¢â‚¬â„¢ÃƒÆ’Ã‚Â¢ÃƒÂ¢Ã¢â‚¬Å¡Ã‚Â¬Ãƒâ€šÃ‚Â ÃƒÆ’Ã†â€™Ãƒâ€šÃ‚Â¢ÃƒÆ’Ã‚Â¢ÃƒÂ¢Ã¢â€šÂ¬Ã…Â¡Ãƒâ€šÃ‚Â¬ÃƒÆ’Ã‚Â¢ÃƒÂ¢Ã¢â€šÂ¬Ã…Â¾Ãƒâ€šÃ‚Â¢ÃƒÆ’Ã†â€™Ãƒâ€ Ã¢â‚¬â„¢ÃƒÆ’Ã¢â‚¬Â ÃƒÂ¢Ã¢â€šÂ¬Ã¢â€žÂ¢ÃƒÆ’Ã†â€™ÃƒÂ¢Ã¢â€šÂ¬Ã…Â¡ÃƒÆ’Ã¢â‚¬Å¡Ãƒâ€šÃ‚Â¢ÃƒÆ’Ã†â€™Ãƒâ€ Ã¢â‚¬â„¢ÃƒÆ’Ã¢â‚¬Å¡Ãƒâ€šÃ‚Â¢ÃƒÆ’Ã†â€™Ãƒâ€šÃ‚Â¢ÃƒÆ’Ã‚Â¢ÃƒÂ¢Ã¢â€šÂ¬Ã…Â¡Ãƒâ€šÃ‚Â¬ÃƒÆ’Ã¢â‚¬Â¦Ãƒâ€šÃ‚Â¡ÃƒÆ’Ã†â€™ÃƒÂ¢Ã¢â€šÂ¬Ã…Â¡ÃƒÆ’Ã¢â‚¬Å¡Ãƒâ€šÃ‚Â¬ÃƒÆ’Ã†â€™Ãƒâ€ Ã¢â‚¬â„¢ÃƒÆ’Ã‚Â¢ÃƒÂ¢Ã¢â‚¬Å¡Ã‚Â¬Ãƒâ€šÃ‚Â¦ÃƒÆ’Ã†â€™ÃƒÂ¢Ã¢â€šÂ¬Ã…Â¡ÃƒÆ’Ã¢â‚¬Å¡Ãƒâ€šÃ‚Â¡ÃƒÆ’Ã†â€™Ãƒâ€ Ã¢â‚¬â„¢ÃƒÆ’Ã¢â‚¬Â ÃƒÂ¢Ã¢â€šÂ¬Ã¢â€žÂ¢ÃƒÆ’Ã†â€™ÃƒÂ¢Ã¢â€šÂ¬Ã‚Â ÃƒÆ’Ã‚Â¢ÃƒÂ¢Ã¢â‚¬Å¡Ã‚Â¬ÃƒÂ¢Ã¢â‚¬Å¾Ã‚Â¢ÃƒÆ’Ã†â€™Ãƒâ€ Ã¢â‚¬â„¢ÃƒÆ’Ã¢â‚¬Å¡Ãƒâ€šÃ‚Â¢ÃƒÆ’Ã†â€™Ãƒâ€šÃ‚Â¢ÃƒÆ’Ã‚Â¢ÃƒÂ¢Ã¢â‚¬Å¡Ã‚Â¬Ãƒâ€¦Ã‚Â¡ÃƒÆ’Ã¢â‚¬Å¡Ãƒâ€šÃ‚Â¬ÃƒÆ’Ã†â€™ÃƒÂ¢Ã¢â€šÂ¬Ã‚Â¦ÃƒÆ’Ã¢â‚¬Å¡Ãƒâ€šÃ‚Â¡ÃƒÆ’Ã†â€™Ãƒâ€ Ã¢â‚¬â„¢ÃƒÆ’Ã¢â‚¬Â ÃƒÂ¢Ã¢â€šÂ¬Ã¢â€žÂ¢ÃƒÆ’Ã†â€™Ãƒâ€šÃ‚Â¢ÃƒÆ’Ã‚Â¢ÃƒÂ¢Ã¢â€šÂ¬Ã…Â¡Ãƒâ€šÃ‚Â¬ÃƒÆ’Ã¢â‚¬Â¦Ãƒâ€šÃ‚Â¡ÃƒÆ’Ã†â€™Ãƒâ€ Ã¢â‚¬â„¢ÃƒÆ’Ã‚Â¢ÃƒÂ¢Ã¢â‚¬Å¡Ã‚Â¬Ãƒâ€¦Ã‚Â¡ÃƒÆ’Ã†â€™ÃƒÂ¢Ã¢â€šÂ¬Ã…Â¡ÃƒÆ’Ã¢â‚¬Å¡Ãƒâ€šÃ‚Â¬ÃƒÆ’Ã†â€™Ãƒâ€ Ã¢â‚¬â„¢ÃƒÆ’Ã¢â‚¬Â ÃƒÂ¢Ã¢â€šÂ¬Ã¢â€žÂ¢ÃƒÆ’Ã†â€™ÃƒÂ¢Ã¢â€šÂ¬Ã‚Â ÃƒÆ’Ã‚Â¢ÃƒÂ¢Ã¢â‚¬Å¡Ã‚Â¬ÃƒÂ¢Ã¢â‚¬Å¾Ã‚Â¢ÃƒÆ’Ã†â€™Ãƒâ€ Ã¢â‚¬â„¢ÃƒÆ’Ã‚Â¢ÃƒÂ¢Ã¢â‚¬Å¡Ã‚Â¬Ãƒâ€šÃ‚Â ÃƒÆ’Ã†â€™Ãƒâ€šÃ‚Â¢ÃƒÆ’Ã‚Â¢ÃƒÂ¢Ã¢â€šÂ¬Ã…Â¡Ãƒâ€šÃ‚Â¬ÃƒÆ’Ã‚Â¢ÃƒÂ¢Ã¢â€šÂ¬Ã…Â¾Ãƒâ€šÃ‚Â¢ÃƒÆ’Ã†â€™Ãƒâ€ Ã¢â‚¬â„¢ÃƒÆ’Ã¢â‚¬Â ÃƒÂ¢Ã¢â€šÂ¬Ã¢â€žÂ¢ÃƒÆ’Ã†â€™Ãƒâ€šÃ‚Â¢ÃƒÆ’Ã‚Â¢ÃƒÂ¢Ã¢â€šÂ¬Ã…Â¡Ãƒâ€šÃ‚Â¬ÃƒÆ’Ã¢â‚¬Å¡Ãƒâ€šÃ‚Â ÃƒÆ’Ã†â€™Ãƒâ€ Ã¢â‚¬â„¢ÃƒÆ’Ã¢â‚¬Å¡Ãƒâ€šÃ‚Â¢ÃƒÆ’Ã†â€™Ãƒâ€šÃ‚Â¢ÃƒÆ’Ã‚Â¢ÃƒÂ¢Ã¢â‚¬Å¡Ã‚Â¬Ãƒâ€¦Ã‚Â¡ÃƒÆ’Ã¢â‚¬Å¡Ãƒâ€šÃ‚Â¬ÃƒÆ’Ã†â€™Ãƒâ€šÃ‚Â¢ÃƒÆ’Ã‚Â¢ÃƒÂ¢Ã¢â‚¬Å¡Ã‚Â¬Ãƒâ€¦Ã‚Â¾ÃƒÆ’Ã¢â‚¬Å¡Ãƒâ€šÃ‚Â¢ÃƒÆ’Ã†â€™Ãƒâ€ Ã¢â‚¬â„¢ÃƒÆ’Ã¢â‚¬Â ÃƒÂ¢Ã¢â€šÂ¬Ã¢â€žÂ¢ÃƒÆ’Ã†â€™ÃƒÂ¢Ã¢â€šÂ¬Ã‚Â ÃƒÆ’Ã‚Â¢ÃƒÂ¢Ã¢â‚¬Å¡Ã‚Â¬ÃƒÂ¢Ã¢â‚¬Å¾Ã‚Â¢ÃƒÆ’Ã†â€™Ãƒâ€ Ã¢â‚¬â„¢ÃƒÆ’Ã¢â‚¬Å¡Ãƒâ€šÃ‚Â¢ÃƒÆ’Ã†â€™Ãƒâ€šÃ‚Â¢ÃƒÆ’Ã‚Â¢ÃƒÂ¢Ã¢â‚¬Å¡Ã‚Â¬Ãƒâ€¦Ã‚Â¡ÃƒÆ’Ã¢â‚¬Å¡Ãƒâ€šÃ‚Â¬ÃƒÆ’Ã†â€™ÃƒÂ¢Ã¢â€šÂ¬Ã‚Â¦ÃƒÆ’Ã¢â‚¬Å¡Ãƒâ€šÃ‚Â¡ÃƒÆ’Ã†â€™Ãƒâ€ Ã¢â‚¬â„¢ÃƒÆ’Ã¢â‚¬Â ÃƒÂ¢Ã¢â€šÂ¬Ã¢â€žÂ¢ÃƒÆ’Ã†â€™Ãƒâ€šÃ‚Â¢ÃƒÆ’Ã‚Â¢ÃƒÂ¢Ã¢â€šÂ¬Ã…Â¡Ãƒâ€šÃ‚Â¬ÃƒÆ’Ã¢â‚¬Â¦Ãƒâ€šÃ‚Â¡ÃƒÆ’Ã†â€™Ãƒâ€ Ã¢â‚¬â„¢ÃƒÆ’Ã‚Â¢ÃƒÂ¢Ã¢â‚¬Å¡Ã‚Â¬Ãƒâ€¦Ã‚Â¡ÃƒÆ’Ã†â€™ÃƒÂ¢Ã¢â€šÂ¬Ã…Â¡ÃƒÆ’Ã¢â‚¬Å¡Ãƒâ€šÃ‚Â¢ÃƒÆ’Ã†â€™Ãƒâ€ Ã¢â‚¬â„¢ÃƒÆ’Ã¢â‚¬Â ÃƒÂ¢Ã¢â€šÂ¬Ã¢â€žÂ¢ÃƒÆ’Ã†â€™ÃƒÂ¢Ã¢â€šÂ¬Ã‚Â ÃƒÆ’Ã‚Â¢ÃƒÂ¢Ã¢â‚¬Å¡Ã‚Â¬ÃƒÂ¢Ã¢â‚¬Å¾Ã‚Â¢ÃƒÆ’Ã†â€™Ãƒâ€ Ã¢â‚¬â„¢ÃƒÆ’Ã‚Â¢ÃƒÂ¢Ã¢â‚¬Å¡Ã‚Â¬Ãƒâ€šÃ‚Â ÃƒÆ’Ã†â€™Ãƒâ€šÃ‚Â¢ÃƒÆ’Ã‚Â¢ÃƒÂ¢Ã¢â€šÂ¬Ã…Â¡Ãƒâ€šÃ‚Â¬ÃƒÆ’Ã‚Â¢ÃƒÂ¢Ã¢â€šÂ¬Ã…Â¾Ãƒâ€šÃ‚Â¢ÃƒÆ’Ã†â€™Ãƒâ€ Ã¢â‚¬â„¢ÃƒÆ’Ã¢â‚¬Â ÃƒÂ¢Ã¢â€šÂ¬Ã¢â€žÂ¢ÃƒÆ’Ã†â€™Ãƒâ€šÃ‚Â¢ÃƒÆ’Ã‚Â¢ÃƒÂ¢Ã¢â€šÂ¬Ã…Â¡Ãƒâ€šÃ‚Â¬ÃƒÆ’Ã¢â‚¬Â¦Ãƒâ€šÃ‚Â¡ÃƒÆ’Ã†â€™Ãƒâ€ Ã¢â‚¬â„¢ÃƒÆ’Ã‚Â¢ÃƒÂ¢Ã¢â‚¬Å¡Ã‚Â¬Ãƒâ€¦Ã‚Â¡ÃƒÆ’Ã†â€™ÃƒÂ¢Ã¢â€šÂ¬Ã…Â¡ÃƒÆ’Ã¢â‚¬Å¡Ãƒâ€šÃ‚Â¢ÃƒÆ’Ã†â€™Ãƒâ€ Ã¢â‚¬â„¢ÃƒÆ’Ã¢â‚¬Â ÃƒÂ¢Ã¢â€šÂ¬Ã¢â€žÂ¢ÃƒÆ’Ã†â€™ÃƒÂ¢Ã¢â€šÂ¬Ã‚Â ÃƒÆ’Ã‚Â¢ÃƒÂ¢Ã¢â‚¬Å¡Ã‚Â¬ÃƒÂ¢Ã¢â‚¬Å¾Ã‚Â¢ÃƒÆ’Ã†â€™Ãƒâ€ Ã¢â‚¬â„¢ÃƒÆ’Ã‚Â¢ÃƒÂ¢Ã¢â‚¬Å¡Ã‚Â¬Ãƒâ€¦Ã‚Â¡ÃƒÆ’Ã†â€™ÃƒÂ¢Ã¢â€šÂ¬Ã…Â¡ÃƒÆ’Ã¢â‚¬Å¡Ãƒâ€šÃ‚Â¢ÃƒÆ’Ã†â€™Ãƒâ€ Ã¢â‚¬â„¢ÃƒÆ’Ã¢â‚¬Â ÃƒÂ¢Ã¢â€šÂ¬Ã¢â€žÂ¢ÃƒÆ’Ã†â€™ÃƒÂ¢Ã¢â€šÂ¬Ã…Â¡ÃƒÆ’Ã¢â‚¬Å¡Ãƒâ€šÃ‚Â¢ÃƒÆ’Ã†â€™Ãƒâ€ Ã¢â‚¬â„¢ÃƒÆ’Ã¢â‚¬Å¡Ãƒâ€šÃ‚Â¢ÃƒÆ’Ã†â€™Ãƒâ€šÃ‚Â¢ÃƒÆ’Ã‚Â¢ÃƒÂ¢Ã¢â‚¬Å¡Ã‚Â¬Ãƒâ€¦Ã‚Â¡ÃƒÆ’Ã¢â‚¬Å¡Ãƒâ€šÃ‚Â¬ÃƒÆ’Ã†â€™ÃƒÂ¢Ã¢â€šÂ¬Ã‚Â¦ÃƒÆ’Ã¢â‚¬Å¡Ãƒâ€šÃ‚Â¡ÃƒÆ’Ã†â€™Ãƒâ€ Ã¢â‚¬â„¢ÃƒÆ’Ã‚Â¢ÃƒÂ¢Ã¢â‚¬Å¡Ã‚Â¬Ãƒâ€¦Ã‚Â¡ÃƒÆ’Ã†â€™ÃƒÂ¢Ã¢â€šÂ¬Ã…Â¡ÃƒÆ’Ã¢â‚¬Å¡Ãƒâ€šÃ‚Â¬ÃƒÆ’Ã†â€™Ãƒâ€ Ã¢â‚¬â„¢ÃƒÆ’Ã¢â‚¬Â ÃƒÂ¢Ã¢â€šÂ¬Ã¢â€žÂ¢ÃƒÆ’Ã†â€™Ãƒâ€šÃ‚Â¢ÃƒÆ’Ã‚Â¢ÃƒÂ¢Ã¢â€šÂ¬Ã…Â¡Ãƒâ€šÃ‚Â¬ÃƒÆ’Ã¢â‚¬Å¡Ãƒâ€šÃ‚Â¦ÃƒÆ’Ã†â€™Ãƒâ€ Ã¢â‚¬â„¢ÃƒÆ’Ã‚Â¢ÃƒÂ¢Ã¢â‚¬Å¡Ã‚Â¬Ãƒâ€¦Ã‚Â¡ÃƒÆ’Ã†â€™ÃƒÂ¢Ã¢â€šÂ¬Ã…Â¡ÃƒÆ’Ã¢â‚¬Å¡Ãƒâ€šÃ‚Â¡ÃƒÆ’Ã†â€™Ãƒâ€ Ã¢â‚¬â„¢ÃƒÆ’Ã¢â‚¬Â ÃƒÂ¢Ã¢â€šÂ¬Ã¢â€žÂ¢ÃƒÆ’Ã†â€™ÃƒÂ¢Ã¢â€šÂ¬Ã‚Â ÃƒÆ’Ã‚Â¢ÃƒÂ¢Ã¢â‚¬Å¡Ã‚Â¬ÃƒÂ¢Ã¢â‚¬Å¾Ã‚Â¢ÃƒÆ’Ã†â€™Ãƒâ€ Ã¢â‚¬â„¢ÃƒÆ’Ã¢â‚¬Å¡Ãƒâ€šÃ‚Â¢ÃƒÆ’Ã†â€™Ãƒâ€šÃ‚Â¢ÃƒÆ’Ã‚Â¢ÃƒÂ¢Ã¢â‚¬Å¡Ã‚Â¬Ãƒâ€¦Ã‚Â¡ÃƒÆ’Ã¢â‚¬Å¡Ãƒâ€šÃ‚Â¬ÃƒÆ’Ã†â€™ÃƒÂ¢Ã¢â€šÂ¬Ã‚Â¦ÃƒÆ’Ã¢â‚¬Å¡Ãƒâ€šÃ‚Â¡ÃƒÆ’Ã†â€™Ãƒâ€ Ã¢â‚¬â„¢ÃƒÆ’Ã¢â‚¬Â ÃƒÂ¢Ã¢â€šÂ¬Ã¢â€žÂ¢ÃƒÆ’Ã†â€™Ãƒâ€šÃ‚Â¢ÃƒÆ’Ã‚Â¢ÃƒÂ¢Ã¢â€šÂ¬Ã…Â¡Ãƒâ€šÃ‚Â¬ÃƒÆ’Ã¢â‚¬Â¦Ãƒâ€šÃ‚Â¡ÃƒÆ’Ã†â€™Ãƒâ€ Ã¢â‚¬â„¢ÃƒÆ’Ã‚Â¢ÃƒÂ¢Ã¢â‚¬Å¡Ã‚Â¬Ãƒâ€¦Ã‚Â¡ÃƒÆ’Ã†â€™ÃƒÂ¢Ã¢â€šÂ¬Ã…Â¡ÃƒÆ’Ã¢â‚¬Å¡Ãƒâ€šÃ‚Â¬ÃƒÆ’Ã†â€™Ãƒâ€ Ã¢â‚¬â„¢ÃƒÆ’Ã¢â‚¬Â ÃƒÂ¢Ã¢â€šÂ¬Ã¢â€žÂ¢ÃƒÆ’Ã†â€™ÃƒÂ¢Ã¢â€šÂ¬Ã‚Â ÃƒÆ’Ã‚Â¢ÃƒÂ¢Ã¢â‚¬Å¡Ã‚Â¬ÃƒÂ¢Ã¢â‚¬Å¾Ã‚Â¢ÃƒÆ’Ã†â€™Ãƒâ€ Ã¢â‚¬â„¢ÃƒÆ’Ã‚Â¢ÃƒÂ¢Ã¢â‚¬Å¡Ã‚Â¬Ãƒâ€šÃ‚Â ÃƒÆ’Ã†â€™Ãƒâ€šÃ‚Â¢ÃƒÆ’Ã‚Â¢ÃƒÂ¢Ã¢â€šÂ¬Ã…Â¡Ãƒâ€šÃ‚Â¬ÃƒÆ’Ã‚Â¢ÃƒÂ¢Ã¢â€šÂ¬Ã…Â¾Ãƒâ€šÃ‚Â¢ÃƒÆ’Ã†â€™Ãƒâ€ Ã¢â‚¬â„¢ÃƒÆ’Ã¢â‚¬Â ÃƒÂ¢Ã¢â€šÂ¬Ã¢â€žÂ¢ÃƒÆ’Ã†â€™ÃƒÂ¢Ã¢â€šÂ¬Ã…Â¡ÃƒÆ’Ã¢â‚¬Å¡Ãƒâ€šÃ‚Â¢ÃƒÆ’Ã†â€™Ãƒâ€ Ã¢â‚¬â„¢ÃƒÆ’Ã¢â‚¬Å¡Ãƒâ€šÃ‚Â¢ÃƒÆ’Ã†â€™Ãƒâ€šÃ‚Â¢ÃƒÆ’Ã‚Â¢ÃƒÂ¢Ã¢â€šÂ¬Ã…Â¡Ãƒâ€šÃ‚Â¬ÃƒÆ’Ã¢â‚¬Â¦Ãƒâ€šÃ‚Â¡ÃƒÆ’Ã†â€™ÃƒÂ¢Ã¢â€šÂ¬Ã…Â¡ÃƒÆ’Ã¢â‚¬Å¡Ãƒâ€šÃ‚Â¬ÃƒÆ’Ã†â€™Ãƒâ€ Ã¢â‚¬â„¢ÃƒÆ’Ã‚Â¢ÃƒÂ¢Ã¢â‚¬Å¡Ã‚Â¬Ãƒâ€¦Ã‚Â¡ÃƒÆ’Ã†â€™ÃƒÂ¢Ã¢â€šÂ¬Ã…Â¡ÃƒÆ’Ã¢â‚¬Å¡Ãƒâ€šÃ‚Â¦ÃƒÆ’Ã†â€™Ãƒâ€ Ã¢â‚¬â„¢ÃƒÆ’Ã¢â‚¬Â ÃƒÂ¢Ã¢â€šÂ¬Ã¢â€žÂ¢ÃƒÆ’Ã†â€™ÃƒÂ¢Ã¢â€šÂ¬Ã‚Â ÃƒÆ’Ã‚Â¢ÃƒÂ¢Ã¢â‚¬Å¡Ã‚Â¬ÃƒÂ¢Ã¢â‚¬Å¾Ã‚Â¢ÃƒÆ’Ã†â€™Ãƒâ€ Ã¢â‚¬â„¢ÃƒÆ’Ã‚Â¢ÃƒÂ¢Ã¢â‚¬Å¡Ã‚Â¬Ãƒâ€¦Ã‚Â¡ÃƒÆ’Ã†â€™ÃƒÂ¢Ã¢â€šÂ¬Ã…Â¡ÃƒÆ’Ã¢â‚¬Å¡Ãƒâ€šÃ‚Â¢ÃƒÆ’Ã†â€™Ãƒâ€ Ã¢â‚¬â„¢ÃƒÆ’Ã¢â‚¬Â ÃƒÂ¢Ã¢â€šÂ¬Ã¢â€žÂ¢ÃƒÆ’Ã†â€™ÃƒÂ¢Ã¢â€šÂ¬Ã…Â¡ÃƒÆ’Ã¢â‚¬Å¡Ãƒâ€šÃ‚Â¢ÃƒÆ’Ã†â€™Ãƒâ€ Ã¢â‚¬â„¢ÃƒÆ’Ã¢â‚¬Å¡Ãƒâ€šÃ‚Â¢ÃƒÆ’Ã†â€™Ãƒâ€šÃ‚Â¢ÃƒÆ’Ã‚Â¢ÃƒÂ¢Ã¢â‚¬Å¡Ã‚Â¬Ãƒâ€¦Ã‚Â¡ÃƒÆ’Ã¢â‚¬Å¡Ãƒâ€šÃ‚Â¬ÃƒÆ’Ã†â€™ÃƒÂ¢Ã¢â€šÂ¬Ã‚Â¦ÃƒÆ’Ã¢â‚¬Å¡Ãƒâ€šÃ‚Â¡ÃƒÆ’Ã†â€™Ãƒâ€ Ã¢â‚¬â„¢ÃƒÆ’Ã‚Â¢ÃƒÂ¢Ã¢â‚¬Å¡Ã‚Â¬Ãƒâ€¦Ã‚Â¡ÃƒÆ’Ã†â€™ÃƒÂ¢Ã¢â€šÂ¬Ã…Â¡ÃƒÆ’Ã¢â‚¬Å¡Ãƒâ€šÃ‚Â¬ÃƒÆ’Ã†â€™Ãƒâ€ Ã¢â‚¬â„¢ÃƒÆ’Ã¢â‚¬Â ÃƒÂ¢Ã¢â€šÂ¬Ã¢â€žÂ¢ÃƒÆ’Ã†â€™Ãƒâ€šÃ‚Â¢ÃƒÆ’Ã‚Â¢ÃƒÂ¢Ã¢â€šÂ¬Ã…Â¡Ãƒâ€šÃ‚Â¬ÃƒÆ’Ã¢â‚¬Å¡Ãƒâ€šÃ‚Â¦ÃƒÆ’Ã†â€™Ãƒâ€ Ã¢â‚¬â„¢ÃƒÆ’Ã¢â‚¬Å¡Ãƒâ€šÃ‚Â¢ÃƒÆ’Ã†â€™Ãƒâ€šÃ‚Â¢ÃƒÆ’Ã‚Â¢ÃƒÂ¢Ã¢â‚¬Å¡Ã‚Â¬Ãƒâ€¦Ã‚Â¡ÃƒÆ’Ã¢â‚¬Å¡Ãƒâ€šÃ‚Â¬ÃƒÆ’Ã†â€™ÃƒÂ¢Ã¢â€šÂ¬Ã‚Â¦ÃƒÆ’Ã‚Â¢ÃƒÂ¢Ã¢â‚¬Å¡Ã‚Â¬Ãƒâ€¦Ã¢â‚¬Å“5), the salinity levels of both treatments briefly converged at about 21.5 ppt in Week 4. This was followed by a notable divergence in Week 5, where Monoculture salinity increased sharply to approximately 24.0 ppt, while the IMTA system </w:t>
       </w:r>
       <w:r>
         <w:rPr>
@@ -6923,7 +6923,7 @@
         <w:rPr>
           <w:rFonts w:ascii="Times New Roman" w:hAnsi="Times New Roman" w:cs="Times New Roman"/>
         </w:rPr>
-        <w:t>The line graph illustrates the weekly variation in water temperature (ÃƒÆ’Ã†â€™Ãƒâ€ Ã¢â‚¬â„¢ÃƒÆ’Ã¢â‚¬Â ÃƒÂ¢Ã¢â€šÂ¬Ã¢â€žÂ¢ÃƒÆ’Ã†â€™ÃƒÂ¢Ã¢â€šÂ¬Ã‚Â ÃƒÆ’Ã‚Â¢ÃƒÂ¢Ã¢â‚¬Å¡Ã‚Â¬ÃƒÂ¢Ã¢â‚¬Å¾Ã‚Â¢ÃƒÆ’Ã†â€™Ãƒâ€ Ã¢â‚¬â„¢ÃƒÆ’Ã‚Â¢ÃƒÂ¢Ã¢â‚¬Å¡Ã‚Â¬Ãƒâ€šÃ‚Â ÃƒÆ’Ã†â€™Ãƒâ€šÃ‚Â¢ÃƒÆ’Ã‚Â¢ÃƒÂ¢Ã¢â€šÂ¬Ã…Â¡Ãƒâ€šÃ‚Â¬ÃƒÆ’Ã‚Â¢ÃƒÂ¢Ã¢â€šÂ¬Ã…Â¾Ãƒâ€šÃ‚Â¢ÃƒÆ’Ã†â€™Ãƒâ€ Ã¢â‚¬â„¢ÃƒÆ’Ã¢â‚¬Â ÃƒÂ¢Ã¢â€šÂ¬Ã¢â€žÂ¢ÃƒÆ’Ã†â€™Ãƒâ€šÃ‚Â¢ÃƒÆ’Ã‚Â¢ÃƒÂ¢Ã¢â€šÂ¬Ã…Â¡Ãƒâ€šÃ‚Â¬ÃƒÆ’Ã¢â‚¬Å¡Ãƒâ€šÃ‚Â ÃƒÆ’Ã†â€™Ãƒâ€ Ã¢â‚¬â„¢ÃƒÆ’Ã¢â‚¬Å¡Ãƒâ€šÃ‚Â¢ÃƒÆ’Ã†â€™Ãƒâ€šÃ‚Â¢ÃƒÆ’Ã‚Â¢ÃƒÂ¢Ã¢â‚¬Å¡Ã‚Â¬Ãƒâ€¦Ã‚Â¡ÃƒÆ’Ã¢â‚¬Å¡Ãƒâ€šÃ‚Â¬ÃƒÆ’Ã†â€™Ãƒâ€šÃ‚Â¢ÃƒÆ’Ã‚Â¢ÃƒÂ¢Ã¢â‚¬Å¡Ã‚Â¬Ãƒâ€¦Ã‚Â¾ÃƒÆ’Ã¢â‚¬Å¡Ãƒâ€šÃ‚Â¢ÃƒÆ’Ã†â€™Ãƒâ€ Ã¢â‚¬â„¢ÃƒÆ’Ã¢â‚¬Â ÃƒÂ¢Ã¢â€šÂ¬Ã¢â€žÂ¢ÃƒÆ’Ã†â€™ÃƒÂ¢Ã¢â€šÂ¬Ã‚Â ÃƒÆ’Ã‚Â¢ÃƒÂ¢Ã¢â‚¬Å¡Ã‚Â¬ÃƒÂ¢Ã¢â‚¬Å¾Ã‚Â¢ÃƒÆ’Ã†â€™Ãƒâ€ Ã¢â‚¬â„¢ÃƒÆ’Ã‚Â¢ÃƒÂ¢Ã¢â‚¬Å¡Ã‚Â¬Ãƒâ€¦Ã‚Â¡ÃƒÆ’Ã†â€™ÃƒÂ¢Ã¢â€šÂ¬Ã…Â¡ÃƒÆ’Ã¢â‚¬Å¡Ãƒâ€šÃ‚Â¢ÃƒÆ’Ã†â€™Ãƒâ€ Ã¢â‚¬â„¢ÃƒÆ’Ã¢â‚¬Â ÃƒÂ¢Ã¢â€šÂ¬Ã¢â€žÂ¢ÃƒÆ’Ã†â€™ÃƒÂ¢Ã¢â€šÂ¬Ã…Â¡ÃƒÆ’Ã¢â‚¬Å¡Ãƒâ€šÃ‚Â¢ÃƒÆ’Ã†â€™Ãƒâ€ Ã¢â‚¬â„¢ÃƒÆ’Ã¢â‚¬Å¡Ãƒâ€šÃ‚Â¢ÃƒÆ’Ã†â€™Ãƒâ€šÃ‚Â¢ÃƒÆ’Ã‚Â¢ÃƒÂ¢Ã¢â‚¬Å¡Ã‚Â¬Ãƒâ€¦Ã‚Â¡ÃƒÆ’Ã¢â‚¬Å¡Ãƒâ€šÃ‚Â¬ÃƒÆ’Ã†â€™ÃƒÂ¢Ã¢â€šÂ¬Ã‚Â¦ÃƒÆ’Ã¢â‚¬Å¡Ãƒâ€šÃ‚Â¡ÃƒÆ’Ã†â€™Ãƒâ€ Ã¢â‚¬â„¢ÃƒÆ’Ã‚Â¢ÃƒÂ¢Ã¢â‚¬Å¡Ã‚Â¬Ãƒâ€¦Ã‚Â¡ÃƒÆ’Ã†â€™ÃƒÂ¢Ã¢â€šÂ¬Ã…Â¡ÃƒÆ’Ã¢â‚¬Å¡Ãƒâ€šÃ‚Â¬ÃƒÆ’Ã†â€™Ãƒâ€ Ã¢â‚¬â„¢ÃƒÆ’Ã¢â‚¬Â ÃƒÂ¢Ã¢â€šÂ¬Ã¢â€žÂ¢ÃƒÆ’Ã†â€™Ãƒâ€šÃ‚Â¢ÃƒÆ’Ã‚Â¢ÃƒÂ¢Ã¢â€šÂ¬Ã…Â¡Ãƒâ€šÃ‚Â¬ÃƒÆ’Ã¢â‚¬Å¡Ãƒâ€šÃ‚Â¦ÃƒÆ’Ã†â€™Ãƒâ€ Ã¢â‚¬â„¢ÃƒÆ’Ã‚Â¢ÃƒÂ¢Ã¢â‚¬Å¡Ã‚Â¬Ãƒâ€¦Ã‚Â¡ÃƒÆ’Ã†â€™ÃƒÂ¢Ã¢â€šÂ¬Ã…Â¡ÃƒÆ’Ã¢â‚¬Å¡Ãƒâ€šÃ‚Â¡ÃƒÆ’Ã†â€™Ãƒâ€ Ã¢â‚¬â„¢ÃƒÆ’Ã¢â‚¬Â ÃƒÂ¢Ã¢â€šÂ¬Ã¢â€žÂ¢ÃƒÆ’Ã†â€™ÃƒÂ¢Ã¢â€šÂ¬Ã‚Â ÃƒÆ’Ã‚Â¢ÃƒÂ¢Ã¢â‚¬Å¡Ã‚Â¬ÃƒÂ¢Ã¢â‚¬Å¾Ã‚Â¢ÃƒÆ’Ã†â€™Ãƒâ€ Ã¢â‚¬â„¢ÃƒÆ’Ã‚Â¢ÃƒÂ¢Ã¢â‚¬Å¡Ã‚Â¬Ãƒâ€šÃ‚Â ÃƒÆ’Ã†â€™Ãƒâ€šÃ‚Â¢ÃƒÆ’Ã‚Â¢ÃƒÂ¢Ã¢â€šÂ¬Ã…Â¡Ãƒâ€šÃ‚Â¬ÃƒÆ’Ã‚Â¢ÃƒÂ¢Ã¢â€šÂ¬Ã…Â¾Ãƒâ€šÃ‚Â¢ÃƒÆ’Ã†â€™Ãƒâ€ Ã¢â‚¬â„¢ÃƒÆ’Ã¢â‚¬Â ÃƒÂ¢Ã¢â€šÂ¬Ã¢â€žÂ¢ÃƒÆ’Ã†â€™ÃƒÂ¢Ã¢â€šÂ¬Ã…Â¡ÃƒÆ’Ã¢â‚¬Å¡Ãƒâ€šÃ‚Â¢ÃƒÆ’Ã†â€™Ãƒâ€ Ã¢â‚¬â„¢ÃƒÆ’Ã¢â‚¬Å¡Ãƒâ€šÃ‚Â¢ÃƒÆ’Ã†â€™Ãƒâ€šÃ‚Â¢ÃƒÆ’Ã‚Â¢ÃƒÂ¢Ã¢â€šÂ¬Ã…Â¡Ãƒâ€šÃ‚Â¬ÃƒÆ’Ã¢â‚¬Â¦Ãƒâ€šÃ‚Â¡ÃƒÆ’Ã†â€™ÃƒÂ¢Ã¢â€šÂ¬Ã…Â¡ÃƒÆ’Ã¢â‚¬Å¡Ãƒâ€šÃ‚Â¬ÃƒÆ’Ã†â€™Ãƒâ€ Ã¢â‚¬â„¢ÃƒÆ’Ã‚Â¢ÃƒÂ¢Ã¢â‚¬Å¡Ã‚Â¬Ãƒâ€šÃ‚Â¦ÃƒÆ’Ã†â€™ÃƒÂ¢Ã¢â€šÂ¬Ã…Â¡ÃƒÆ’Ã¢â‚¬Å¡Ãƒâ€šÃ‚Â¡ÃƒÆ’Ã†â€™Ãƒâ€ Ã¢â‚¬â„¢ÃƒÆ’Ã¢â‚¬Â ÃƒÂ¢Ã¢â€šÂ¬Ã¢â€žÂ¢ÃƒÆ’Ã†â€™ÃƒÂ¢Ã¢â€šÂ¬Ã‚Â ÃƒÆ’Ã‚Â¢ÃƒÂ¢Ã¢â‚¬Å¡Ã‚Â¬ÃƒÂ¢Ã¢â‚¬Å¾Ã‚Â¢ÃƒÆ’Ã†â€™Ãƒâ€ Ã¢â‚¬â„¢ÃƒÆ’Ã¢â‚¬Å¡Ãƒâ€šÃ‚Â¢ÃƒÆ’Ã†â€™Ãƒâ€šÃ‚Â¢ÃƒÆ’Ã‚Â¢ÃƒÂ¢Ã¢â‚¬Å¡Ã‚Â¬Ãƒâ€¦Ã‚Â¡ÃƒÆ’Ã¢â‚¬Å¡Ãƒâ€šÃ‚Â¬ÃƒÆ’Ã†â€™ÃƒÂ¢Ã¢â€šÂ¬Ã‚Â¦ÃƒÆ’Ã¢â‚¬Å¡Ãƒâ€šÃ‚Â¡ÃƒÆ’Ã†â€™Ãƒâ€ Ã¢â‚¬â„¢ÃƒÆ’Ã¢â‚¬Â ÃƒÂ¢Ã¢â€šÂ¬Ã¢â€žÂ¢ÃƒÆ’Ã†â€™Ãƒâ€šÃ‚Â¢ÃƒÆ’Ã‚Â¢ÃƒÂ¢Ã¢â€šÂ¬Ã…Â¡Ãƒâ€šÃ‚Â¬ÃƒÆ’Ã¢â‚¬Â¦Ãƒâ€šÃ‚Â¡ÃƒÆ’Ã†â€™Ãƒâ€ Ã¢â‚¬â„¢ÃƒÆ’Ã‚Â¢ÃƒÂ¢Ã¢â‚¬Å¡Ã‚Â¬Ãƒâ€¦Ã‚Â¡ÃƒÆ’Ã†â€™ÃƒÂ¢Ã¢â€šÂ¬Ã…Â¡ÃƒÆ’Ã¢â‚¬Å¡Ãƒâ€šÃ‚Â°C) in two aquaculture systems, Integrated Multi-Trophic Aquaculture (IMTA) and Monoculture, over a seven-week period. Overall, both treatments exhibited a very similar pattern of fluctuation throughout the study. At the beginning (Week 1), water temperature was relatively high in both systems, with Monoculture showing a slightly higher value (approximately 28.7ÃƒÆ’Ã†â€™Ãƒâ€ Ã¢â‚¬â„¢ÃƒÆ’Ã¢â‚¬Â ÃƒÂ¢Ã¢â€šÂ¬Ã¢â€žÂ¢ÃƒÆ’Ã†â€™ÃƒÂ¢Ã¢â€šÂ¬Ã‚Â ÃƒÆ’Ã‚Â¢ÃƒÂ¢Ã¢â‚¬Å¡Ã‚Â¬ÃƒÂ¢Ã¢â‚¬Å¾Ã‚Â¢ÃƒÆ’Ã†â€™Ãƒâ€ Ã¢â‚¬â„¢ÃƒÆ’Ã‚Â¢ÃƒÂ¢Ã¢â‚¬Å¡Ã‚Â¬Ãƒâ€šÃ‚Â ÃƒÆ’Ã†â€™Ãƒâ€šÃ‚Â¢ÃƒÆ’Ã‚Â¢ÃƒÂ¢Ã¢â€šÂ¬Ã…Â¡Ãƒâ€šÃ‚Â¬ÃƒÆ’Ã‚Â¢ÃƒÂ¢Ã¢â€šÂ¬Ã…Â¾Ãƒâ€šÃ‚Â¢ÃƒÆ’Ã†â€™Ãƒâ€ Ã¢â‚¬â„¢ÃƒÆ’Ã¢â‚¬Â ÃƒÂ¢Ã¢â€šÂ¬Ã¢â€žÂ¢ÃƒÆ’Ã†â€™Ãƒâ€šÃ‚Â¢ÃƒÆ’Ã‚Â¢ÃƒÂ¢Ã¢â€šÂ¬Ã…Â¡Ãƒâ€šÃ‚Â¬ÃƒÆ’Ã¢â‚¬Å¡Ãƒâ€šÃ‚Â ÃƒÆ’Ã†â€™Ãƒâ€ Ã¢â‚¬â„¢ÃƒÆ’Ã¢â‚¬Å¡Ãƒâ€šÃ‚Â¢ÃƒÆ’Ã†â€™Ãƒâ€šÃ‚Â¢ÃƒÆ’Ã‚Â¢ÃƒÂ¢Ã¢â‚¬Å¡Ã‚Â¬Ãƒâ€¦Ã‚Â¡ÃƒÆ’Ã¢â‚¬Å¡Ãƒâ€šÃ‚Â¬ÃƒÆ’Ã†â€™Ãƒâ€šÃ‚Â¢ÃƒÆ’Ã‚Â¢ÃƒÂ¢Ã¢â‚¬Å¡Ã‚Â¬Ãƒâ€¦Ã‚Â¾ÃƒÆ’Ã¢â‚¬Å¡Ãƒâ€šÃ‚Â¢ÃƒÆ’Ã†â€™Ãƒâ€ Ã¢â‚¬â„¢ÃƒÆ’Ã¢â‚¬Â ÃƒÂ¢Ã¢â€šÂ¬Ã¢â€žÂ¢ÃƒÆ’Ã†â€™ÃƒÂ¢Ã¢â€šÂ¬Ã‚Â ÃƒÆ’Ã‚Â¢ÃƒÂ¢Ã¢â‚¬Å¡Ã‚Â¬ÃƒÂ¢Ã¢â‚¬Å¾Ã‚Â¢ÃƒÆ’Ã†â€™Ãƒâ€ Ã¢â‚¬â„¢ÃƒÆ’Ã‚Â¢ÃƒÂ¢Ã¢â‚¬Å¡Ã‚Â¬Ãƒâ€¦Ã‚Â¡ÃƒÆ’Ã†â€™ÃƒÂ¢Ã¢â€šÂ¬Ã…Â¡ÃƒÆ’Ã¢â‚¬Å¡Ãƒâ€šÃ‚Â¢ÃƒÆ’Ã†â€™Ãƒâ€ Ã¢â‚¬â„¢ÃƒÆ’Ã¢â‚¬Â ÃƒÂ¢Ã¢â€šÂ¬Ã¢â€žÂ¢ÃƒÆ’Ã†â€™ÃƒÂ¢Ã¢â€šÂ¬Ã…Â¡ÃƒÆ’Ã¢â‚¬Å¡Ãƒâ€šÃ‚Â¢ÃƒÆ’Ã†â€™Ãƒâ€ Ã¢â‚¬â„¢ÃƒÆ’Ã¢â‚¬Å¡Ãƒâ€šÃ‚Â¢ÃƒÆ’Ã†â€™Ãƒâ€šÃ‚Â¢ÃƒÆ’Ã‚Â¢ÃƒÂ¢Ã¢â‚¬Å¡Ã‚Â¬Ãƒâ€¦Ã‚Â¡ÃƒÆ’Ã¢â‚¬Å¡Ãƒâ€šÃ‚Â¬ÃƒÆ’Ã†â€™ÃƒÂ¢Ã¢â€šÂ¬Ã‚Â¦ÃƒÆ’Ã¢â‚¬Å¡Ãƒâ€šÃ‚Â¡ÃƒÆ’Ã†â€™Ãƒâ€ Ã¢â‚¬â„¢ÃƒÆ’Ã‚Â¢ÃƒÂ¢Ã¢â‚¬Å¡Ã‚Â¬Ãƒâ€¦Ã‚Â¡ÃƒÆ’Ã†â€™ÃƒÂ¢Ã¢â€šÂ¬Ã…Â¡ÃƒÆ’Ã¢â‚¬Å¡Ãƒâ€šÃ‚Â¬ÃƒÆ’Ã†â€™Ãƒâ€ Ã¢â‚¬â„¢ÃƒÆ’Ã¢â‚¬Â ÃƒÂ¢Ã¢â€šÂ¬Ã¢â€žÂ¢ÃƒÆ’Ã†â€™Ãƒâ€šÃ‚Â¢ÃƒÆ’Ã‚Â¢ÃƒÂ¢Ã¢â€šÂ¬Ã…Â¡Ãƒâ€šÃ‚Â¬ÃƒÆ’Ã¢â‚¬Å¡Ãƒâ€šÃ‚Â¦ÃƒÆ’Ã†â€™Ãƒâ€ Ã¢â‚¬â„¢ÃƒÆ’Ã‚Â¢ÃƒÂ¢Ã¢â‚¬Å¡Ã‚Â¬Ãƒâ€¦Ã‚Â¡ÃƒÆ’Ã†â€™ÃƒÂ¢Ã¢â€šÂ¬Ã…Â¡ÃƒÆ’Ã¢â‚¬Å¡Ãƒâ€šÃ‚Â¡ÃƒÆ’Ã†â€™Ãƒâ€ Ã¢â‚¬â„¢ÃƒÆ’Ã¢â‚¬Â ÃƒÂ¢Ã¢â€šÂ¬Ã¢â€žÂ¢ÃƒÆ’Ã†â€™ÃƒÂ¢Ã¢â€šÂ¬Ã‚Â ÃƒÆ’Ã‚Â¢ÃƒÂ¢Ã¢â‚¬Å¡Ã‚Â¬ÃƒÂ¢Ã¢â‚¬Å¾Ã‚Â¢ÃƒÆ’Ã†â€™Ãƒâ€ Ã¢â‚¬â„¢ÃƒÆ’Ã‚Â¢ÃƒÂ¢Ã¢â‚¬Å¡Ã‚Â¬Ãƒâ€šÃ‚Â ÃƒÆ’Ã†â€™Ãƒâ€šÃ‚Â¢ÃƒÆ’Ã‚Â¢ÃƒÂ¢Ã¢â€šÂ¬Ã…Â¡Ãƒâ€šÃ‚Â¬ÃƒÆ’Ã‚Â¢ÃƒÂ¢Ã¢â€šÂ¬Ã…Â¾Ãƒâ€šÃ‚Â¢ÃƒÆ’Ã†â€™Ãƒâ€ Ã¢â‚¬â„¢ÃƒÆ’Ã¢â‚¬Â ÃƒÂ¢Ã¢â€šÂ¬Ã¢â€žÂ¢ÃƒÆ’Ã†â€™ÃƒÂ¢Ã¢â€šÂ¬Ã…Â¡ÃƒÆ’Ã¢â‚¬Å¡Ãƒâ€šÃ‚Â¢ÃƒÆ’Ã†â€™Ãƒâ€ Ã¢â‚¬â„¢ÃƒÆ’Ã¢â‚¬Å¡Ãƒâ€šÃ‚Â¢ÃƒÆ’Ã†â€™Ãƒâ€šÃ‚Â¢ÃƒÆ’Ã‚Â¢ÃƒÂ¢Ã¢â€šÂ¬Ã…Â¡Ãƒâ€šÃ‚Â¬ÃƒÆ’Ã¢â‚¬Â¦Ãƒâ€šÃ‚Â¡ÃƒÆ’Ã†â€™ÃƒÂ¢Ã¢â€šÂ¬Ã…Â¡ÃƒÆ’Ã¢â‚¬Å¡Ãƒâ€šÃ‚Â¬ÃƒÆ’Ã†â€™Ãƒâ€ Ã¢â‚¬â„¢ÃƒÆ’Ã‚Â¢ÃƒÂ¢Ã¢â‚¬Å¡Ã‚Â¬Ãƒâ€šÃ‚Â¦ÃƒÆ’Ã†â€™ÃƒÂ¢Ã¢â€šÂ¬Ã…Â¡ÃƒÆ’Ã¢â‚¬Å¡Ãƒâ€šÃ‚Â¡ÃƒÆ’Ã†â€™Ãƒâ€ Ã¢â‚¬â„¢ÃƒÆ’Ã¢â‚¬Â ÃƒÂ¢Ã¢â€šÂ¬Ã¢â€žÂ¢ÃƒÆ’Ã†â€™ÃƒÂ¢Ã¢â€šÂ¬Ã‚Â ÃƒÆ’Ã‚Â¢ÃƒÂ¢Ã¢â‚¬Å¡Ã‚Â¬ÃƒÂ¢Ã¢â‚¬Å¾Ã‚Â¢ÃƒÆ’Ã†â€™Ãƒâ€ Ã¢â‚¬â„¢ÃƒÆ’Ã¢â‚¬Å¡Ãƒâ€šÃ‚Â¢ÃƒÆ’Ã†â€™Ãƒâ€šÃ‚Â¢ÃƒÆ’Ã‚Â¢ÃƒÂ¢Ã¢â‚¬Å¡Ã‚Â¬Ãƒâ€¦Ã‚Â¡ÃƒÆ’Ã¢â‚¬Å¡Ãƒâ€šÃ‚Â¬ÃƒÆ’Ã†â€™ÃƒÂ¢Ã¢â€šÂ¬Ã‚Â¦ÃƒÆ’Ã¢â‚¬Å¡Ãƒâ€šÃ‚Â¡ÃƒÆ’Ã†â€™Ãƒâ€ Ã¢â‚¬â„¢ÃƒÆ’Ã¢â‚¬Â ÃƒÂ¢Ã¢â€šÂ¬Ã¢â€žÂ¢ÃƒÆ’Ã†â€™Ãƒâ€šÃ‚Â¢ÃƒÆ’Ã‚Â¢ÃƒÂ¢Ã¢â€šÂ¬Ã…Â¡Ãƒâ€šÃ‚Â¬ÃƒÆ’Ã¢â‚¬Â¦Ãƒâ€šÃ‚Â¡ÃƒÆ’Ã†â€™Ãƒâ€ Ã¢â‚¬â„¢ÃƒÆ’Ã‚Â¢ÃƒÂ¢Ã¢â‚¬Å¡Ã‚Â¬Ãƒâ€¦Ã‚Â¡ÃƒÆ’Ã†â€™ÃƒÂ¢Ã¢â€šÂ¬Ã…Â¡ÃƒÆ’Ã¢â‚¬Å¡Ãƒâ€šÃ‚Â°C) compared to IMTA (around 28.2ÃƒÆ’Ã†â€™Ãƒâ€ Ã¢â‚¬â„¢ÃƒÆ’Ã¢â‚¬Â ÃƒÂ¢Ã¢â€šÂ¬Ã¢â€žÂ¢ÃƒÆ’Ã†â€™ÃƒÂ¢Ã¢â€šÂ¬Ã‚Â ÃƒÆ’Ã‚Â¢ÃƒÂ¢Ã¢â‚¬Å¡Ã‚Â¬ÃƒÂ¢Ã¢â‚¬Å¾Ã‚Â¢ÃƒÆ’Ã†â€™Ãƒâ€ Ã¢â‚¬â„¢ÃƒÆ’Ã‚Â¢ÃƒÂ¢Ã¢â‚¬Å¡Ã‚Â¬Ãƒâ€šÃ‚Â ÃƒÆ’Ã†â€™Ãƒâ€šÃ‚Â¢ÃƒÆ’Ã‚Â¢ÃƒÂ¢Ã¢â€šÂ¬Ã…Â¡Ãƒâ€šÃ‚Â¬ÃƒÆ’Ã‚Â¢ÃƒÂ¢Ã¢â€šÂ¬Ã…Â¾Ãƒâ€šÃ‚Â¢ÃƒÆ’Ã†â€™Ãƒâ€ Ã¢â‚¬â„¢ÃƒÆ’Ã¢â‚¬Â ÃƒÂ¢Ã¢â€šÂ¬Ã¢â€žÂ¢ÃƒÆ’Ã†â€™Ãƒâ€šÃ‚Â¢ÃƒÆ’Ã‚Â¢ÃƒÂ¢Ã¢â€šÂ¬Ã…Â¡Ãƒâ€šÃ‚Â¬ÃƒÆ’Ã¢â‚¬Å¡Ãƒâ€šÃ‚Â ÃƒÆ’Ã†â€™Ãƒâ€ Ã¢â‚¬â„¢ÃƒÆ’Ã¢â‚¬Å¡Ãƒâ€šÃ‚Â¢ÃƒÆ’Ã†â€™Ãƒâ€šÃ‚Â¢ÃƒÆ’Ã‚Â¢ÃƒÂ¢Ã¢â‚¬Å¡Ã‚Â¬Ãƒâ€¦Ã‚Â¡ÃƒÆ’Ã¢â‚¬Å¡Ãƒâ€šÃ‚Â¬ÃƒÆ’Ã†â€™Ãƒâ€šÃ‚Â¢ÃƒÆ’Ã‚Â¢ÃƒÂ¢Ã¢â‚¬Å¡Ã‚Â¬Ãƒâ€¦Ã‚Â¾ÃƒÆ’Ã¢â‚¬Å¡Ãƒâ€šÃ‚Â¢ÃƒÆ’Ã†â€™Ãƒâ€ Ã¢â‚¬â„¢ÃƒÆ’Ã¢â‚¬Â ÃƒÂ¢Ã¢â€šÂ¬Ã¢â€žÂ¢ÃƒÆ’Ã†â€™ÃƒÂ¢Ã¢â€šÂ¬Ã‚Â ÃƒÆ’Ã‚Â¢ÃƒÂ¢Ã¢â‚¬Å¡Ã‚Â¬ÃƒÂ¢Ã¢â‚¬Å¾Ã‚Â¢ÃƒÆ’Ã†â€™Ãƒâ€ Ã¢â‚¬â„¢ÃƒÆ’Ã‚Â¢ÃƒÂ¢Ã¢â‚¬Å¡Ã‚Â¬Ãƒâ€¦Ã‚Â¡ÃƒÆ’Ã†â€™ÃƒÂ¢Ã¢â€šÂ¬Ã…Â¡ÃƒÆ’Ã¢â‚¬Å¡Ãƒâ€šÃ‚Â¢ÃƒÆ’Ã†â€™Ãƒâ€ Ã¢â‚¬â„¢ÃƒÆ’Ã¢â‚¬Â ÃƒÂ¢Ã¢â€šÂ¬Ã¢â€žÂ¢ÃƒÆ’Ã†â€™ÃƒÂ¢Ã¢â€šÂ¬Ã…Â¡ÃƒÆ’Ã¢â‚¬Å¡Ãƒâ€šÃ‚Â¢ÃƒÆ’Ã†â€™Ãƒâ€ Ã¢â‚¬â„¢ÃƒÆ’Ã¢â‚¬Å¡Ãƒâ€šÃ‚Â¢ÃƒÆ’Ã†â€™Ãƒâ€šÃ‚Â¢ÃƒÆ’Ã‚Â¢ÃƒÂ¢Ã¢â‚¬Å¡Ã‚Â¬Ãƒâ€¦Ã‚Â¡ÃƒÆ’Ã¢â‚¬Å¡Ãƒâ€šÃ‚Â¬ÃƒÆ’Ã†â€™ÃƒÂ¢Ã¢â€šÂ¬Ã‚Â¦ÃƒÆ’Ã¢â‚¬Å¡Ãƒâ€šÃ‚Â¡ÃƒÆ’Ã†â€™Ãƒâ€ Ã¢â‚¬â„¢ÃƒÆ’Ã‚Â¢ÃƒÂ¢Ã¢â‚¬Å¡Ã‚Â¬Ãƒâ€¦Ã‚Â¡ÃƒÆ’Ã†â€™ÃƒÂ¢Ã¢â€šÂ¬Ã…Â¡ÃƒÆ’Ã¢â‚¬Å¡Ãƒâ€šÃ‚Â¬ÃƒÆ’Ã†â€™Ãƒâ€ Ã¢â‚¬â„¢ÃƒÆ’Ã¢â‚¬Â ÃƒÂ¢Ã¢â€šÂ¬Ã¢â€žÂ¢ÃƒÆ’Ã†â€™Ãƒâ€šÃ‚Â¢ÃƒÆ’Ã‚Â¢ÃƒÂ¢Ã¢â€šÂ¬Ã…Â¡Ãƒâ€šÃ‚Â¬ÃƒÆ’Ã¢â‚¬Å¡Ãƒâ€šÃ‚Â¦ÃƒÆ’Ã†â€™Ãƒâ€ Ã¢â‚¬â„¢ÃƒÆ’Ã‚Â¢ÃƒÂ¢Ã¢â‚¬Å¡Ã‚Â¬Ãƒâ€¦Ã‚Â¡ÃƒÆ’Ã†â€™ÃƒÂ¢Ã¢â€šÂ¬Ã…Â¡ÃƒÆ’Ã¢â‚¬Å¡Ãƒâ€šÃ‚Â¡ÃƒÆ’Ã†â€™Ãƒâ€ Ã¢â‚¬â„¢ÃƒÆ’Ã¢â‚¬Â ÃƒÂ¢Ã¢â€šÂ¬Ã¢â€žÂ¢ÃƒÆ’Ã†â€™ÃƒÂ¢Ã¢â€šÂ¬Ã‚Â ÃƒÆ’Ã‚Â¢ÃƒÂ¢Ã¢â‚¬Å¡Ã‚Â¬ÃƒÂ¢Ã¢â‚¬Å¾Ã‚Â¢ÃƒÆ’Ã†â€™Ãƒâ€ Ã¢â‚¬â„¢ÃƒÆ’Ã‚Â¢ÃƒÂ¢Ã¢â‚¬Å¡Ã‚Â¬Ãƒâ€šÃ‚Â ÃƒÆ’Ã†â€™Ãƒâ€šÃ‚Â¢ÃƒÆ’Ã‚Â¢ÃƒÂ¢Ã¢â€šÂ¬Ã…Â¡Ãƒâ€šÃ‚Â¬ÃƒÆ’Ã‚Â¢ÃƒÂ¢Ã¢â€šÂ¬Ã…Â¾Ãƒâ€šÃ‚Â¢ÃƒÆ’Ã†â€™Ãƒâ€ Ã¢â‚¬â„¢ÃƒÆ’Ã¢â‚¬Â ÃƒÂ¢Ã¢â€šÂ¬Ã¢â€žÂ¢ÃƒÆ’Ã†â€™ÃƒÂ¢Ã¢â€šÂ¬Ã…Â¡ÃƒÆ’Ã¢â‚¬Å¡Ãƒâ€šÃ‚Â¢ÃƒÆ’Ã†â€™Ãƒâ€ Ã¢â‚¬â„¢ÃƒÆ’Ã¢â‚¬Å¡Ãƒâ€šÃ‚Â¢ÃƒÆ’Ã†â€™Ãƒâ€šÃ‚Â¢ÃƒÆ’Ã‚Â¢ÃƒÂ¢Ã¢â€šÂ¬Ã…Â¡Ãƒâ€šÃ‚Â¬ÃƒÆ’Ã¢â‚¬Â¦Ãƒâ€šÃ‚Â¡ÃƒÆ’Ã†â€™ÃƒÂ¢Ã¢â€šÂ¬Ã…Â¡ÃƒÆ’Ã¢â‚¬Å¡Ãƒâ€šÃ‚Â¬ÃƒÆ’Ã†â€™Ãƒâ€ Ã¢â‚¬â„¢ÃƒÆ’Ã‚Â¢ÃƒÂ¢Ã¢â‚¬Å¡Ã‚Â¬Ãƒâ€šÃ‚Â¦ÃƒÆ’Ã†â€™ÃƒÂ¢Ã¢â€šÂ¬Ã…Â¡ÃƒÆ’Ã¢â‚¬Å¡Ãƒâ€šÃ‚Â¡ÃƒÆ’Ã†â€™Ãƒâ€ Ã¢â‚¬â„¢ÃƒÆ’Ã¢â‚¬Â ÃƒÂ¢Ã¢â€šÂ¬Ã¢â€žÂ¢ÃƒÆ’Ã†â€™ÃƒÂ¢Ã¢â€šÂ¬Ã‚Â ÃƒÆ’Ã‚Â¢ÃƒÂ¢Ã¢â‚¬Å¡Ã‚Â¬ÃƒÂ¢Ã¢â‚¬Å¾Ã‚Â¢ÃƒÆ’Ã†â€™Ãƒâ€ Ã¢â‚¬â„¢ÃƒÆ’Ã¢â‚¬Å¡Ãƒâ€šÃ‚Â¢ÃƒÆ’Ã†â€™Ãƒâ€šÃ‚Â¢ÃƒÆ’Ã‚Â¢ÃƒÂ¢Ã¢â‚¬Å¡Ã‚Â¬Ãƒâ€¦Ã‚Â¡ÃƒÆ’Ã¢â‚¬Å¡Ãƒâ€šÃ‚Â¬ÃƒÆ’Ã†â€™ÃƒÂ¢Ã¢â€šÂ¬Ã‚Â¦ÃƒÆ’Ã¢â‚¬Å¡Ãƒâ€šÃ‚Â¡ÃƒÆ’Ã†â€™Ãƒâ€ Ã¢â‚¬â„¢ÃƒÆ’Ã¢â‚¬Â ÃƒÂ¢Ã¢â€šÂ¬Ã¢â€žÂ¢ÃƒÆ’Ã†â€™Ãƒâ€šÃ‚Â¢ÃƒÆ’Ã‚Â¢ÃƒÂ¢Ã¢â€šÂ¬Ã…Â¡Ãƒâ€šÃ‚Â¬ÃƒÆ’Ã¢â‚¬Â¦Ãƒâ€šÃ‚Â¡ÃƒÆ’Ã†â€™Ãƒâ€ Ã¢â‚¬â„¢ÃƒÆ’Ã‚Â¢ÃƒÂ¢Ã¢â‚¬Å¡Ã‚Â¬Ãƒâ€¦Ã‚Â¡ÃƒÆ’Ã†â€™ÃƒÂ¢Ã¢â€šÂ¬Ã…Â¡ÃƒÆ’Ã¢â‚¬Å¡Ãƒâ€šÃ‚Â°C). From Week 1 to Week 4, a clear declining trend was observed in both treatments, reaching the lowest temperatures at Week 4 (about 25.9ÃƒÆ’Ã†â€™Ãƒâ€ Ã¢â‚¬â„¢ÃƒÆ’Ã¢â‚¬Â ÃƒÂ¢Ã¢â€šÂ¬Ã¢â€žÂ¢ÃƒÆ’Ã†â€™ÃƒÂ¢Ã¢â€šÂ¬Ã‚Â ÃƒÆ’Ã‚Â¢ÃƒÂ¢Ã¢â‚¬Å¡Ã‚Â¬ÃƒÂ¢Ã¢â‚¬Å¾Ã‚Â¢ÃƒÆ’Ã†â€™Ãƒâ€ Ã¢â‚¬â„¢ÃƒÆ’Ã‚Â¢ÃƒÂ¢Ã¢â‚¬Å¡Ã‚Â¬Ãƒâ€šÃ‚Â ÃƒÆ’Ã†â€™Ãƒâ€šÃ‚Â¢ÃƒÆ’Ã‚Â¢ÃƒÂ¢Ã¢â€šÂ¬Ã…Â¡Ãƒâ€šÃ‚Â¬ÃƒÆ’Ã‚Â¢ÃƒÂ¢Ã¢â€šÂ¬Ã…Â¾Ãƒâ€šÃ‚Â¢ÃƒÆ’Ã†â€™Ãƒâ€ Ã¢â‚¬â„¢ÃƒÆ’Ã¢â‚¬Â ÃƒÂ¢Ã¢â€šÂ¬Ã¢â€žÂ¢ÃƒÆ’Ã†â€™Ãƒâ€šÃ‚Â¢ÃƒÆ’Ã‚Â¢ÃƒÂ¢Ã¢â€šÂ¬Ã…Â¡Ãƒâ€šÃ‚Â¬ÃƒÆ’Ã¢â‚¬Å¡Ãƒâ€šÃ‚Â ÃƒÆ’Ã†â€™Ãƒâ€ Ã¢â‚¬â„¢ÃƒÆ’Ã¢â‚¬Å¡Ãƒâ€šÃ‚Â¢ÃƒÆ’Ã†â€™Ãƒâ€šÃ‚Â¢ÃƒÆ’Ã‚Â¢ÃƒÂ¢Ã¢â‚¬Å¡Ã‚Â¬Ãƒâ€¦Ã‚Â¡ÃƒÆ’Ã¢â‚¬Å¡Ãƒâ€šÃ‚Â¬ÃƒÆ’Ã†â€™Ãƒâ€šÃ‚Â¢ÃƒÆ’Ã‚Â¢ÃƒÂ¢Ã¢â‚¬Å¡Ã‚Â¬Ãƒâ€¦Ã‚Â¾ÃƒÆ’Ã¢â‚¬Å¡Ãƒâ€šÃ‚Â¢ÃƒÆ’Ã†â€™Ãƒâ€ Ã¢â‚¬â„¢ÃƒÆ’Ã¢â‚¬Â ÃƒÂ¢Ã¢â€šÂ¬Ã¢â€žÂ¢ÃƒÆ’Ã†â€™ÃƒÂ¢Ã¢â€šÂ¬Ã‚Â ÃƒÆ’Ã‚Â¢ÃƒÂ¢Ã¢â‚¬Å¡Ã‚Â¬ÃƒÂ¢Ã¢â‚¬Å¾Ã‚Â¢ÃƒÆ’Ã†â€™Ãƒâ€ Ã¢â‚¬â„¢ÃƒÆ’Ã‚Â¢ÃƒÂ¢Ã¢â‚¬Å¡Ã‚Â¬Ãƒâ€¦Ã‚Â¡ÃƒÆ’Ã†â€™ÃƒÂ¢Ã¢â€šÂ¬Ã…Â¡ÃƒÆ’Ã¢â‚¬Å¡Ãƒâ€šÃ‚Â¢ÃƒÆ’Ã†â€™Ãƒâ€ Ã¢â‚¬â„¢ÃƒÆ’Ã¢â‚¬Â ÃƒÂ¢Ã¢â€šÂ¬Ã¢â€žÂ¢ÃƒÆ’Ã†â€™ÃƒÂ¢Ã¢â€šÂ¬Ã…Â¡ÃƒÆ’Ã¢â‚¬Å¡Ãƒâ€šÃ‚Â¢ÃƒÆ’Ã†â€™Ãƒâ€ Ã¢â‚¬â„¢ÃƒÆ’Ã¢â‚¬Å¡Ãƒâ€šÃ‚Â¢ÃƒÆ’Ã†â€™Ãƒâ€šÃ‚Â¢ÃƒÆ’Ã‚Â¢ÃƒÂ¢Ã¢â‚¬Å¡Ã‚Â¬Ãƒâ€¦Ã‚Â¡ÃƒÆ’Ã¢â‚¬Å¡Ãƒâ€šÃ‚Â¬ÃƒÆ’Ã†â€™ÃƒÂ¢Ã¢â€šÂ¬Ã‚Â¦ÃƒÆ’Ã¢â‚¬Å¡Ãƒâ€šÃ‚Â¡ÃƒÆ’Ã†â€™Ãƒâ€ Ã¢â‚¬â„¢ÃƒÆ’Ã‚Â¢ÃƒÂ¢Ã¢â‚¬Å¡Ã‚Â¬Ãƒâ€¦Ã‚Â¡ÃƒÆ’Ã†â€™ÃƒÂ¢Ã¢â€šÂ¬Ã…Â¡ÃƒÆ’Ã¢â‚¬Å¡Ãƒâ€šÃ‚Â¬ÃƒÆ’Ã†â€™Ãƒâ€ Ã¢â‚¬â„¢ÃƒÆ’Ã¢â‚¬Â ÃƒÂ¢Ã¢â€šÂ¬Ã¢â€žÂ¢ÃƒÆ’Ã†â€™Ãƒâ€šÃ‚Â¢ÃƒÆ’Ã‚Â¢ÃƒÂ¢Ã¢â€šÂ¬Ã…Â¡Ãƒâ€šÃ‚Â¬ÃƒÆ’Ã¢â‚¬Å¡Ãƒâ€šÃ‚Â¦ÃƒÆ’Ã†â€™Ãƒâ€ Ã¢â‚¬â„¢ÃƒÆ’Ã‚Â¢ÃƒÂ¢Ã¢â‚¬Å¡Ã‚Â¬Ãƒâ€¦Ã‚Â¡ÃƒÆ’Ã†â€™ÃƒÂ¢Ã¢â€šÂ¬Ã…Â¡ÃƒÆ’Ã¢â‚¬Å¡Ãƒâ€šÃ‚Â¡ÃƒÆ’Ã†â€™Ãƒâ€ Ã¢â‚¬â„¢ÃƒÆ’Ã¢â‚¬Â ÃƒÂ¢Ã¢â€šÂ¬Ã¢â€žÂ¢ÃƒÆ’Ã†â€™ÃƒÂ¢Ã¢â€šÂ¬Ã‚Â ÃƒÆ’Ã‚Â¢ÃƒÂ¢Ã¢â‚¬Å¡Ã‚Â¬ÃƒÂ¢Ã¢â‚¬Å¾Ã‚Â¢ÃƒÆ’Ã†â€™Ãƒâ€ Ã¢â‚¬â„¢ÃƒÆ’Ã‚Â¢ÃƒÂ¢Ã¢â‚¬Å¡Ã‚Â¬Ãƒâ€šÃ‚Â ÃƒÆ’Ã†â€™Ãƒâ€šÃ‚Â¢ÃƒÆ’Ã‚Â¢ÃƒÂ¢Ã¢â€šÂ¬Ã…Â¡Ãƒâ€šÃ‚Â¬ÃƒÆ’Ã‚Â¢ÃƒÂ¢Ã¢â€šÂ¬Ã…Â¾Ãƒâ€šÃ‚Â¢ÃƒÆ’Ã†â€™Ãƒâ€ Ã¢â‚¬â„¢ÃƒÆ’Ã¢â‚¬Â ÃƒÂ¢Ã¢â€šÂ¬Ã¢â€žÂ¢ÃƒÆ’Ã†â€™ÃƒÂ¢Ã¢â€šÂ¬Ã…Â¡ÃƒÆ’Ã¢â‚¬Å¡Ãƒâ€šÃ‚Â¢ÃƒÆ’Ã†â€™Ãƒâ€ Ã¢â‚¬â„¢ÃƒÆ’Ã¢â‚¬Å¡Ãƒâ€šÃ‚Â¢ÃƒÆ’Ã†â€™Ãƒâ€šÃ‚Â¢ÃƒÆ’Ã‚Â¢ÃƒÂ¢Ã¢â€šÂ¬Ã…Â¡Ãƒâ€šÃ‚Â¬ÃƒÆ’Ã¢â‚¬Â¦Ãƒâ€šÃ‚Â¡ÃƒÆ’Ã†â€™ÃƒÂ¢Ã¢â€šÂ¬Ã…Â¡ÃƒÆ’Ã¢â‚¬Å¡Ãƒâ€šÃ‚Â¬ÃƒÆ’Ã†â€™Ãƒâ€ Ã¢â‚¬â„¢ÃƒÆ’Ã‚Â¢ÃƒÂ¢Ã¢â‚¬Å¡Ã‚Â¬Ãƒâ€šÃ‚Â¦ÃƒÆ’Ã†â€™ÃƒÂ¢Ã¢â€šÂ¬Ã…Â¡ÃƒÆ’Ã¢â‚¬Å¡Ãƒâ€šÃ‚Â¡ÃƒÆ’Ã†â€™Ãƒâ€ Ã¢â‚¬â„¢ÃƒÆ’Ã¢â‚¬Â ÃƒÂ¢Ã¢â€šÂ¬Ã¢â€žÂ¢ÃƒÆ’Ã†â€™ÃƒÂ¢Ã¢â€šÂ¬Ã‚Â ÃƒÆ’Ã‚Â¢ÃƒÂ¢Ã¢â‚¬Å¡Ã‚Â¬ÃƒÂ¢Ã¢â‚¬Å¾Ã‚Â¢ÃƒÆ’Ã†â€™Ãƒâ€ Ã¢â‚¬â„¢ÃƒÆ’Ã¢â‚¬Å¡Ãƒâ€šÃ‚Â¢ÃƒÆ’Ã†â€™Ãƒâ€šÃ‚Â¢ÃƒÆ’Ã‚Â¢ÃƒÂ¢Ã¢â‚¬Å¡Ã‚Â¬Ãƒâ€¦Ã‚Â¡ÃƒÆ’Ã¢â‚¬Å¡Ãƒâ€šÃ‚Â¬ÃƒÆ’Ã†â€™ÃƒÂ¢Ã¢â€šÂ¬Ã‚Â¦ÃƒÆ’Ã¢â‚¬Å¡Ãƒâ€šÃ‚Â¡ÃƒÆ’Ã†â€™Ãƒâ€ Ã¢â‚¬â„¢ÃƒÆ’Ã¢â‚¬Â ÃƒÂ¢Ã¢â€šÂ¬Ã¢â€žÂ¢ÃƒÆ’Ã†â€™Ãƒâ€šÃ‚Â¢ÃƒÆ’Ã‚Â¢ÃƒÂ¢Ã¢â€šÂ¬Ã…Â¡Ãƒâ€šÃ‚Â¬ÃƒÆ’Ã¢â‚¬Â¦Ãƒâ€šÃ‚Â¡ÃƒÆ’Ã†â€™Ãƒâ€ Ã¢â‚¬â„¢ÃƒÆ’Ã‚Â¢ÃƒÂ¢Ã¢â‚¬Å¡Ã‚Â¬Ãƒâ€¦Ã‚Â¡ÃƒÆ’Ã†â€™ÃƒÂ¢Ã¢â€šÂ¬Ã…Â¡ÃƒÆ’Ã¢â‚¬Å¡Ãƒâ€šÃ‚Â°C in Monoculture and 25.7ÃƒÆ’Ã†â€™Ãƒâ€ Ã¢â‚¬â„¢ÃƒÆ’Ã¢â‚¬Â ÃƒÂ¢Ã¢â€šÂ¬Ã¢â€žÂ¢ÃƒÆ’Ã†â€™ÃƒÂ¢Ã¢â€šÂ¬Ã‚Â ÃƒÆ’Ã‚Â¢ÃƒÂ¢Ã¢â‚¬Å¡Ã‚Â¬ÃƒÂ¢Ã¢â‚¬Å¾Ã‚Â¢ÃƒÆ’Ã†â€™Ãƒâ€ Ã¢â‚¬â„¢ÃƒÆ’Ã‚Â¢ÃƒÂ¢Ã¢â‚¬Å¡Ã‚Â¬Ãƒâ€šÃ‚Â ÃƒÆ’Ã†â€™Ãƒâ€šÃ‚Â¢ÃƒÆ’Ã‚Â¢ÃƒÂ¢Ã¢â€šÂ¬Ã…Â¡Ãƒâ€šÃ‚Â¬ÃƒÆ’Ã‚Â¢ÃƒÂ¢Ã¢â€šÂ¬Ã…Â¾Ãƒâ€šÃ‚Â¢ÃƒÆ’Ã†â€™Ãƒâ€ Ã¢â‚¬â„¢ÃƒÆ’Ã¢â‚¬Â ÃƒÂ¢Ã¢â€šÂ¬Ã¢â€žÂ¢ÃƒÆ’Ã†â€™Ãƒâ€šÃ‚Â¢ÃƒÆ’Ã‚Â¢ÃƒÂ¢Ã¢â€šÂ¬Ã…Â¡Ãƒâ€šÃ‚Â¬ÃƒÆ’Ã¢â‚¬Å¡Ãƒâ€šÃ‚Â ÃƒÆ’Ã†â€™Ãƒâ€ Ã¢â‚¬â„¢ÃƒÆ’Ã¢â‚¬Å¡Ãƒâ€šÃ‚Â¢ÃƒÆ’Ã†â€™Ãƒâ€šÃ‚Â¢ÃƒÆ’Ã‚Â¢ÃƒÂ¢Ã¢â‚¬Å¡Ã‚Â¬Ãƒâ€¦Ã‚Â¡ÃƒÆ’Ã¢â‚¬Å¡Ãƒâ€šÃ‚Â¬ÃƒÆ’Ã†â€™Ãƒâ€šÃ‚Â¢ÃƒÆ’Ã‚Â¢ÃƒÂ¢Ã¢â‚¬Å¡Ã‚Â¬Ãƒâ€¦Ã‚Â¾ÃƒÆ’Ã¢â‚¬Å¡Ãƒâ€šÃ‚Â¢ÃƒÆ’Ã†â€™Ãƒâ€ Ã¢â‚¬â„¢ÃƒÆ’Ã¢â‚¬Â ÃƒÂ¢Ã¢â€šÂ¬Ã¢â€žÂ¢ÃƒÆ’Ã†â€™ÃƒÂ¢Ã¢â€šÂ¬Ã‚Â ÃƒÆ’Ã‚Â¢ÃƒÂ¢Ã¢â‚¬Å¡Ã‚Â¬ÃƒÂ¢Ã¢â‚¬Å¾Ã‚Â¢ÃƒÆ’Ã†â€™Ãƒâ€ Ã¢â‚¬â„¢ÃƒÆ’Ã‚Â¢ÃƒÂ¢Ã¢â‚¬Å¡Ã‚Â¬Ãƒâ€¦Ã‚Â¡ÃƒÆ’Ã†â€™ÃƒÂ¢Ã¢â€šÂ¬Ã…Â¡ÃƒÆ’Ã¢â‚¬Å¡Ãƒâ€šÃ‚Â¢ÃƒÆ’Ã†â€™Ãƒâ€ Ã¢â‚¬â„¢ÃƒÆ’Ã¢â‚¬Â ÃƒÂ¢Ã¢â€šÂ¬Ã¢â€žÂ¢ÃƒÆ’Ã†â€™ÃƒÂ¢Ã¢â€šÂ¬Ã…Â¡ÃƒÆ’Ã¢â‚¬Å¡Ãƒâ€šÃ‚Â¢ÃƒÆ’Ã†â€™Ãƒâ€ Ã¢â‚¬â„¢ÃƒÆ’Ã¢â‚¬Å¡Ãƒâ€šÃ‚Â¢ÃƒÆ’Ã†â€™Ãƒâ€šÃ‚Â¢ÃƒÆ’Ã‚Â¢ÃƒÂ¢Ã¢â‚¬Å¡Ã‚Â¬Ãƒâ€¦Ã‚Â¡ÃƒÆ’Ã¢â‚¬Å¡Ãƒâ€šÃ‚Â¬ÃƒÆ’Ã†â€™ÃƒÂ¢Ã¢â€šÂ¬Ã‚Â¦ÃƒÆ’Ã¢â‚¬Å¡Ãƒâ€šÃ‚Â¡ÃƒÆ’Ã†â€™Ãƒâ€ Ã¢â‚¬â„¢ÃƒÆ’Ã‚Â¢ÃƒÂ¢Ã¢â‚¬Å¡Ã‚Â¬Ãƒâ€¦Ã‚Â¡ÃƒÆ’Ã†â€™ÃƒÂ¢Ã¢â€šÂ¬Ã…Â¡ÃƒÆ’Ã¢â‚¬Å¡Ãƒâ€šÃ‚Â¬ÃƒÆ’Ã†â€™Ãƒâ€ Ã¢â‚¬â„¢ÃƒÆ’Ã¢â‚¬Â ÃƒÂ¢Ã¢â€šÂ¬Ã¢â€žÂ¢ÃƒÆ’Ã†â€™Ãƒâ€šÃ‚Â¢ÃƒÆ’Ã‚Â¢ÃƒÂ¢Ã¢â€šÂ¬Ã…Â¡Ãƒâ€šÃ‚Â¬ÃƒÆ’Ã¢â‚¬Å¡Ãƒâ€šÃ‚Â¦ÃƒÆ’Ã†â€™Ãƒâ€ Ã¢â‚¬â„¢ÃƒÆ’Ã‚Â¢ÃƒÂ¢Ã¢â‚¬Å¡Ã‚Â¬Ãƒâ€¦Ã‚Â¡ÃƒÆ’Ã†â€™ÃƒÂ¢Ã¢â€šÂ¬Ã…Â¡ÃƒÆ’Ã¢â‚¬Å¡Ãƒâ€šÃ‚Â¡ÃƒÆ’Ã†â€™Ãƒâ€ Ã¢â‚¬â„¢ÃƒÆ’Ã¢â‚¬Â ÃƒÂ¢Ã¢â€šÂ¬Ã¢â€žÂ¢ÃƒÆ’Ã†â€™ÃƒÂ¢Ã¢â€šÂ¬Ã‚Â ÃƒÆ’Ã‚Â¢ÃƒÂ¢Ã¢â‚¬Å¡Ã‚Â¬ÃƒÂ¢Ã¢â‚¬Å¾Ã‚Â¢ÃƒÆ’Ã†â€™Ãƒâ€ Ã¢â‚¬â„¢ÃƒÆ’Ã‚Â¢ÃƒÂ¢Ã¢â‚¬Å¡Ã‚Â¬Ãƒâ€šÃ‚Â ÃƒÆ’Ã†â€™Ãƒâ€šÃ‚Â¢ÃƒÆ’Ã‚Â¢ÃƒÂ¢Ã¢â€šÂ¬Ã…Â¡Ãƒâ€šÃ‚Â¬ÃƒÆ’Ã‚Â¢ÃƒÂ¢Ã¢â€šÂ¬Ã…Â¾Ãƒâ€šÃ‚Â¢ÃƒÆ’Ã†â€™Ãƒâ€ Ã¢â‚¬â„¢ÃƒÆ’Ã¢â‚¬Â ÃƒÂ¢Ã¢â€šÂ¬Ã¢â€žÂ¢ÃƒÆ’Ã†â€™ÃƒÂ¢Ã¢â€šÂ¬Ã…Â¡ÃƒÆ’Ã¢â‚¬Å¡Ãƒâ€šÃ‚Â¢ÃƒÆ’Ã†â€™Ãƒâ€ Ã¢â‚¬â„¢ÃƒÆ’Ã¢â‚¬Å¡Ãƒâ€šÃ‚Â¢ÃƒÆ’Ã†â€™Ãƒâ€šÃ‚Â¢ÃƒÆ’Ã‚Â¢ÃƒÂ¢Ã¢â€šÂ¬Ã…Â¡Ãƒâ€šÃ‚Â¬ÃƒÆ’Ã¢â‚¬Â¦Ãƒâ€šÃ‚Â¡ÃƒÆ’Ã†â€™ÃƒÂ¢Ã¢â€šÂ¬Ã…Â¡ÃƒÆ’Ã¢â‚¬Å¡Ãƒâ€šÃ‚Â¬ÃƒÆ’Ã†â€™Ãƒâ€ Ã¢â‚¬â„¢ÃƒÆ’Ã‚Â¢ÃƒÂ¢Ã¢â‚¬Å¡Ã‚Â¬Ãƒâ€šÃ‚Â¦ÃƒÆ’Ã†â€™ÃƒÂ¢Ã¢â€šÂ¬Ã…Â¡ÃƒÆ’Ã¢â‚¬Å¡Ãƒâ€šÃ‚Â¡ÃƒÆ’Ã†â€™Ãƒâ€ Ã¢â‚¬â„¢ÃƒÆ’Ã¢â‚¬Â ÃƒÂ¢Ã¢â€šÂ¬Ã¢â€žÂ¢ÃƒÆ’Ã†â€™ÃƒÂ¢Ã¢â€šÂ¬Ã‚Â ÃƒÆ’Ã‚Â¢ÃƒÂ¢Ã¢â‚¬Å¡Ã‚Â¬ÃƒÂ¢Ã¢â‚¬Å¾Ã‚Â¢ÃƒÆ’Ã†â€™Ãƒâ€ Ã¢â‚¬â„¢ÃƒÆ’Ã¢â‚¬Å¡Ãƒâ€šÃ‚Â¢ÃƒÆ’Ã†â€™Ãƒâ€šÃ‚Â¢ÃƒÆ’Ã‚Â¢ÃƒÂ¢Ã¢â‚¬Å¡Ã‚Â¬Ãƒâ€¦Ã‚Â¡ÃƒÆ’Ã¢â‚¬Å¡Ãƒâ€šÃ‚Â¬ÃƒÆ’Ã†â€™ÃƒÂ¢Ã¢â€šÂ¬Ã‚Â¦ÃƒÆ’Ã¢â‚¬Å¡Ãƒâ€šÃ‚Â¡ÃƒÆ’Ã†â€™Ãƒâ€ Ã¢â‚¬â„¢ÃƒÆ’Ã¢â‚¬Â ÃƒÂ¢Ã¢â€šÂ¬Ã¢â€žÂ¢ÃƒÆ’Ã†â€™Ãƒâ€šÃ‚Â¢ÃƒÆ’Ã‚Â¢ÃƒÂ¢Ã¢â€šÂ¬Ã…Â¡Ãƒâ€šÃ‚Â¬ÃƒÆ’Ã¢â‚¬Â¦Ãƒâ€šÃ‚Â¡ÃƒÆ’Ã†â€™Ãƒâ€ Ã¢â‚¬â„¢ÃƒÆ’Ã‚Â¢ÃƒÂ¢Ã¢â‚¬Å¡Ã‚Â¬Ãƒâ€¦Ã‚Â¡ÃƒÆ’Ã†â€™ÃƒÂ¢Ã¢â€šÂ¬Ã…Â¡ÃƒÆ’Ã¢â‚¬Å¡Ãƒâ€šÃ‚Â°C in IMTA). Following this decline, temperatures increased sharply in Week 5 and then remained relatively stable through Weeks 6 and 7 at approximately 28.1ÃƒÆ’Ã†â€™Ãƒâ€ Ã¢â‚¬â„¢ÃƒÆ’Ã¢â‚¬Â ÃƒÂ¢Ã¢â€šÂ¬Ã¢â€žÂ¢ÃƒÆ’Ã†â€™ÃƒÂ¢Ã¢â€šÂ¬Ã‚Â ÃƒÆ’Ã‚Â¢ÃƒÂ¢Ã¢â‚¬Å¡Ã‚Â¬ÃƒÂ¢Ã¢â‚¬Å¾Ã‚Â¢ÃƒÆ’Ã†â€™Ãƒâ€ Ã¢â‚¬â„¢ÃƒÆ’Ã‚Â¢ÃƒÂ¢Ã¢â‚¬Å¡Ã‚Â¬Ãƒâ€šÃ‚Â ÃƒÆ’Ã†â€™Ãƒâ€šÃ‚Â¢ÃƒÆ’Ã‚Â¢ÃƒÂ¢Ã¢â€šÂ¬Ã…Â¡Ãƒâ€šÃ‚Â¬ÃƒÆ’Ã‚Â¢ÃƒÂ¢Ã¢â€šÂ¬Ã…Â¾Ãƒâ€šÃ‚Â¢ÃƒÆ’Ã†â€™Ãƒâ€ Ã¢â‚¬â„¢ÃƒÆ’Ã¢â‚¬Â ÃƒÂ¢Ã¢â€šÂ¬Ã¢â€žÂ¢ÃƒÆ’Ã†â€™Ãƒâ€šÃ‚Â¢ÃƒÆ’Ã‚Â¢ÃƒÂ¢Ã¢â€šÂ¬Ã…Â¡Ãƒâ€šÃ‚Â¬ÃƒÆ’Ã¢â‚¬Å¡Ãƒâ€šÃ‚Â ÃƒÆ’Ã†â€™Ãƒâ€ Ã¢â‚¬â„¢ÃƒÆ’Ã¢â‚¬Å¡Ãƒâ€šÃ‚Â¢ÃƒÆ’Ã†â€™Ãƒâ€šÃ‚Â¢ÃƒÆ’Ã‚Â¢ÃƒÂ¢Ã¢â‚¬Å¡Ã‚Â¬Ãƒâ€¦Ã‚Â¡ÃƒÆ’Ã¢â‚¬Å¡Ãƒâ€šÃ‚Â¬ÃƒÆ’Ã†â€™Ãƒâ€šÃ‚Â¢ÃƒÆ’Ã‚Â¢ÃƒÂ¢Ã¢â‚¬Å¡Ã‚Â¬Ãƒâ€¦Ã‚Â¾ÃƒÆ’Ã¢â‚¬Å¡Ãƒâ€šÃ‚Â¢ÃƒÆ’Ã†â€™Ãƒâ€ Ã¢â‚¬â„¢ÃƒÆ’Ã¢â‚¬Â ÃƒÂ¢Ã¢â€šÂ¬Ã¢â€žÂ¢ÃƒÆ’Ã†â€™ÃƒÂ¢Ã¢â€šÂ¬Ã‚Â ÃƒÆ’Ã‚Â¢ÃƒÂ¢Ã¢â‚¬Å¡Ã‚Â¬ÃƒÂ¢Ã¢â‚¬Å¾Ã‚Â¢ÃƒÆ’Ã†â€™Ãƒâ€ Ã¢â‚¬â„¢ÃƒÆ’Ã‚Â¢ÃƒÂ¢Ã¢â‚¬Å¡Ã‚Â¬Ãƒâ€¦Ã‚Â¡ÃƒÆ’Ã†â€™ÃƒÂ¢Ã¢â€šÂ¬Ã…Â¡ÃƒÆ’Ã¢â‚¬Å¡Ãƒâ€šÃ‚Â¢ÃƒÆ’Ã†â€™Ãƒâ€ Ã¢â‚¬â„¢ÃƒÆ’Ã¢â‚¬Â ÃƒÂ¢Ã¢â€šÂ¬Ã¢â€žÂ¢ÃƒÆ’Ã†â€™ÃƒÂ¢Ã¢â€šÂ¬Ã…Â¡ÃƒÆ’Ã¢â‚¬Å¡Ãƒâ€šÃ‚Â¢ÃƒÆ’Ã†â€™Ãƒâ€ Ã¢â‚¬â„¢ÃƒÆ’Ã¢â‚¬Å¡Ãƒâ€šÃ‚Â¢ÃƒÆ’Ã†â€™Ãƒâ€šÃ‚Â¢ÃƒÆ’Ã‚Â¢ÃƒÂ¢Ã¢â‚¬Å¡Ã‚Â¬Ãƒâ€¦Ã‚Â¡ÃƒÆ’Ã¢â‚¬Å¡Ãƒâ€šÃ‚Â¬ÃƒÆ’Ã†â€™ÃƒÂ¢Ã¢â€šÂ¬Ã‚Â¦ÃƒÆ’Ã¢â‚¬Å¡Ãƒâ€šÃ‚Â¡ÃƒÆ’Ã†â€™Ãƒâ€ Ã¢â‚¬â„¢ÃƒÆ’Ã‚Â¢ÃƒÂ¢Ã¢â‚¬Å¡Ã‚Â¬Ãƒâ€¦Ã‚Â¡ÃƒÆ’Ã†â€™ÃƒÂ¢Ã¢â€šÂ¬Ã…Â¡ÃƒÆ’Ã¢â‚¬Å¡Ãƒâ€šÃ‚Â¬ÃƒÆ’Ã†â€™Ãƒâ€ Ã¢â‚¬â„¢ÃƒÆ’Ã¢â‚¬Â ÃƒÂ¢Ã¢â€šÂ¬Ã¢â€žÂ¢ÃƒÆ’Ã†â€™Ãƒâ€šÃ‚Â¢ÃƒÆ’Ã‚Â¢ÃƒÂ¢Ã¢â€šÂ¬Ã…Â¡Ãƒâ€šÃ‚Â¬ÃƒÆ’Ã¢â‚¬Å¡Ãƒâ€šÃ‚Â¦ÃƒÆ’Ã†â€™Ãƒâ€ Ã¢â‚¬â„¢ÃƒÆ’Ã‚Â¢ÃƒÂ¢Ã¢â‚¬Å¡Ã‚Â¬Ãƒâ€¦Ã‚Â¡ÃƒÆ’Ã†â€™ÃƒÂ¢Ã¢â€šÂ¬Ã…Â¡ÃƒÆ’Ã¢â‚¬Å¡Ãƒâ€šÃ‚Â¡ÃƒÆ’Ã†â€™Ãƒâ€ Ã¢â‚¬â„¢ÃƒÆ’Ã¢â‚¬Â ÃƒÂ¢Ã¢â€šÂ¬Ã¢â€žÂ¢ÃƒÆ’Ã†â€™ÃƒÂ¢Ã¢â€šÂ¬Ã‚Â ÃƒÆ’Ã‚Â¢ÃƒÂ¢Ã¢â‚¬Å¡Ã‚Â¬ÃƒÂ¢Ã¢â‚¬Å¾Ã‚Â¢ÃƒÆ’Ã†â€™Ãƒâ€ Ã¢â‚¬â„¢ÃƒÆ’Ã‚Â¢ÃƒÂ¢Ã¢â‚¬Å¡Ã‚Â¬Ãƒâ€šÃ‚Â ÃƒÆ’Ã†â€™Ãƒâ€šÃ‚Â¢ÃƒÆ’Ã‚Â¢ÃƒÂ¢Ã¢â€šÂ¬Ã…Â¡Ãƒâ€šÃ‚Â¬ÃƒÆ’Ã‚Â¢ÃƒÂ¢Ã¢â€šÂ¬Ã…Â¾Ãƒâ€šÃ‚Â¢ÃƒÆ’Ã†â€™Ãƒâ€ Ã¢â‚¬â„¢ÃƒÆ’Ã¢â‚¬Â ÃƒÂ¢Ã¢â€šÂ¬Ã¢â€žÂ¢ÃƒÆ’Ã†â€™ÃƒÂ¢Ã¢â€šÂ¬Ã…Â¡ÃƒÆ’Ã¢â‚¬Å¡Ãƒâ€šÃ‚Â¢ÃƒÆ’Ã†â€™Ãƒâ€ Ã¢â‚¬â„¢ÃƒÆ’Ã¢â‚¬Å¡Ãƒâ€šÃ‚Â¢ÃƒÆ’Ã†â€™Ãƒâ€šÃ‚Â¢ÃƒÆ’Ã‚Â¢ÃƒÂ¢Ã¢â€šÂ¬Ã…Â¡Ãƒâ€šÃ‚Â¬ÃƒÆ’Ã¢â‚¬Â¦Ãƒâ€šÃ‚Â¡ÃƒÆ’Ã†â€™ÃƒÂ¢Ã¢â€šÂ¬Ã…Â¡ÃƒÆ’Ã¢â‚¬Å¡Ãƒâ€šÃ‚Â¬ÃƒÆ’Ã†â€™Ãƒâ€ Ã¢â‚¬â„¢ÃƒÆ’Ã‚Â¢ÃƒÂ¢Ã¢â‚¬Å¡Ã‚Â¬Ãƒâ€šÃ‚Â¦ÃƒÆ’Ã†â€™ÃƒÂ¢Ã¢â€šÂ¬Ã…Â¡ÃƒÆ’Ã¢â‚¬Å¡Ãƒâ€šÃ‚Â¡ÃƒÆ’Ã†â€™Ãƒâ€ Ã¢â‚¬â„¢ÃƒÆ’Ã¢â‚¬Â ÃƒÂ¢Ã¢â€šÂ¬Ã¢â€žÂ¢ÃƒÆ’Ã†â€™ÃƒÂ¢Ã¢â€šÂ¬Ã‚Â ÃƒÆ’Ã‚Â¢ÃƒÂ¢Ã¢â‚¬Å¡Ã‚Â¬ÃƒÂ¢Ã¢â‚¬Å¾Ã‚Â¢ÃƒÆ’Ã†â€™Ãƒâ€ Ã¢â‚¬â„¢ÃƒÆ’Ã¢â‚¬Å¡Ãƒâ€šÃ‚Â¢ÃƒÆ’Ã†â€™Ãƒâ€šÃ‚Â¢ÃƒÆ’Ã‚Â¢ÃƒÂ¢Ã¢â‚¬Å¡Ã‚Â¬Ãƒâ€¦Ã‚Â¡ÃƒÆ’Ã¢â‚¬Å¡Ãƒâ€šÃ‚Â¬ÃƒÆ’Ã†â€™ÃƒÂ¢Ã¢â€šÂ¬Ã‚Â¦ÃƒÆ’Ã¢â‚¬Å¡Ãƒâ€šÃ‚Â¡ÃƒÆ’Ã†â€™Ãƒâ€ Ã¢â‚¬â„¢ÃƒÆ’Ã¢â‚¬Â ÃƒÂ¢Ã¢â€šÂ¬Ã¢â€žÂ¢ÃƒÆ’Ã†â€™Ãƒâ€šÃ‚Â¢ÃƒÆ’Ã‚Â¢ÃƒÂ¢Ã¢â€šÂ¬Ã…Â¡Ãƒâ€šÃ‚Â¬ÃƒÆ’Ã¢â‚¬Â¦Ãƒâ€šÃ‚Â¡ÃƒÆ’Ã†â€™Ãƒâ€ Ã¢â‚¬â„¢ÃƒÆ’Ã‚Â¢ÃƒÂ¢Ã¢â‚¬Å¡Ã‚Â¬Ãƒâ€¦Ã‚Â¡ÃƒÆ’Ã†â€™ÃƒÂ¢Ã¢â€šÂ¬Ã…Â¡ÃƒÆ’Ã¢â‚¬Å¡Ãƒâ€šÃ‚Â°C in both systems.</w:t>
+        <w:t>The line graph illustrates the weekly variation in water temperature (ÃƒÆ’Ã†â€™Ãƒâ€ Ã¢â‚¬â„¢ÃƒÆ’Ã¢â‚¬Â ÃƒÂ¢Ã¢â€šÂ¬Ã¢â€žÂ¢ÃƒÆ’Ã†â€™ÃƒÂ¢Ã¢â€šÂ¬Ã‚Â ÃƒÆ’Ã‚Â¢ÃƒÂ¢Ã¢â‚¬Å¡Ã‚Â¬ÃƒÂ¢Ã¢â‚¬Å¾Ã‚Â¢ÃƒÆ’Ã†â€™Ãƒâ€ Ã¢â‚¬â„¢ÃƒÆ’Ã‚Â¢ÃƒÂ¢Ã¢â‚¬Å¡Ã‚Â¬Ãƒâ€šÃ‚Â ÃƒÆ’Ã†â€™Ãƒâ€šÃ‚Â¢ÃƒÆ’Ã‚Â¢ÃƒÂ¢Ã¢â€šÂ¬Ã…Â¡Ãƒâ€šÃ‚Â¬ÃƒÆ’Ã‚Â¢ÃƒÂ¢Ã¢â€šÂ¬Ã…Â¾Ãƒâ€šÃ‚Â¢ÃƒÆ’Ã†â€™Ãƒâ€ Ã¢â‚¬â„¢ÃƒÆ’Ã¢â‚¬Â ÃƒÂ¢Ã¢â€šÂ¬Ã¢â€žÂ¢ÃƒÆ’Ã†â€™Ãƒâ€šÃ‚Â¢ÃƒÆ’Ã‚Â¢ÃƒÂ¢Ã¢â€šÂ¬Ã…Â¡Ãƒâ€šÃ‚Â¬ÃƒÆ’Ã¢â‚¬Å¡Ãƒâ€šÃ‚Â ÃƒÆ’Ã†â€™Ãƒâ€ Ã¢â‚¬â„¢ÃƒÆ’Ã¢â‚¬Å¡Ãƒâ€šÃ‚Â¢ÃƒÆ’Ã†â€™Ãƒâ€šÃ‚Â¢ÃƒÆ’Ã‚Â¢ÃƒÂ¢Ã¢â‚¬Å¡Ã‚Â¬Ãƒâ€¦Ã‚Â¡ÃƒÆ’Ã¢â‚¬Å¡Ãƒâ€šÃ‚Â¬ÃƒÆ’Ã†â€™Ãƒâ€šÃ‚Â¢ÃƒÆ’Ã‚Â¢ÃƒÂ¢Ã¢â‚¬Å¡Ã‚Â¬Ãƒâ€¦Ã‚Â¾ÃƒÆ’Ã¢â‚¬Å¡Ãƒâ€šÃ‚Â¢ÃƒÆ’Ã†â€™Ãƒâ€ Ã¢â‚¬â„¢ÃƒÆ’Ã¢â‚¬Â ÃƒÂ¢Ã¢â€šÂ¬Ã¢â€žÂ¢ÃƒÆ’Ã†â€™ÃƒÂ¢Ã¢â€šÂ¬Ã‚Â ÃƒÆ’Ã‚Â¢ÃƒÂ¢Ã¢â‚¬Å¡Ã‚Â¬ÃƒÂ¢Ã¢â‚¬Å¾Ã‚Â¢ÃƒÆ’Ã†â€™Ãƒâ€ Ã¢â‚¬â„¢ÃƒÆ’Ã¢â‚¬Å¡Ãƒâ€šÃ‚Â¢ÃƒÆ’Ã†â€™Ãƒâ€šÃ‚Â¢ÃƒÆ’Ã‚Â¢ÃƒÂ¢Ã¢â‚¬Å¡Ã‚Â¬Ãƒâ€¦Ã‚Â¡ÃƒÆ’Ã¢â‚¬Å¡Ãƒâ€šÃ‚Â¬ÃƒÆ’Ã†â€™ÃƒÂ¢Ã¢â€šÂ¬Ã…Â¡ÃƒÆ’Ã¢â‚¬Å¡Ãƒâ€šÃ‚Â ÃƒÆ’Ã†â€™Ãƒâ€ Ã¢â‚¬â„¢ÃƒÆ’Ã¢â‚¬Â ÃƒÂ¢Ã¢â€šÂ¬Ã¢â€žÂ¢ÃƒÆ’Ã†â€™ÃƒÂ¢Ã¢â€šÂ¬Ã…Â¡ÃƒÆ’Ã¢â‚¬Å¡Ãƒâ€šÃ‚Â¢ÃƒÆ’Ã†â€™Ãƒâ€ Ã¢â‚¬â„¢ÃƒÆ’Ã¢â‚¬Å¡Ãƒâ€šÃ‚Â¢ÃƒÆ’Ã†â€™Ãƒâ€šÃ‚Â¢ÃƒÆ’Ã‚Â¢ÃƒÂ¢Ã¢â€šÂ¬Ã…Â¡Ãƒâ€šÃ‚Â¬ÃƒÆ’Ã¢â‚¬Â¦Ãƒâ€šÃ‚Â¡ÃƒÆ’Ã†â€™ÃƒÂ¢Ã¢â€šÂ¬Ã…Â¡ÃƒÆ’Ã¢â‚¬Å¡Ãƒâ€šÃ‚Â¬ÃƒÆ’Ã†â€™Ãƒâ€ Ã¢â‚¬â„¢ÃƒÆ’Ã¢â‚¬Å¡Ãƒâ€šÃ‚Â¢ÃƒÆ’Ã†â€™Ãƒâ€šÃ‚Â¢ÃƒÆ’Ã‚Â¢ÃƒÂ¢Ã¢â€šÂ¬Ã…Â¡Ãƒâ€šÃ‚Â¬ÃƒÆ’Ã¢â‚¬Â¦Ãƒâ€šÃ‚Â¾ÃƒÆ’Ã†â€™ÃƒÂ¢Ã¢â€šÂ¬Ã…Â¡ÃƒÆ’Ã¢â‚¬Å¡Ãƒâ€šÃ‚Â¢ÃƒÆ’Ã†â€™Ãƒâ€ Ã¢â‚¬â„¢ÃƒÆ’Ã¢â‚¬Â ÃƒÂ¢Ã¢â€šÂ¬Ã¢â€žÂ¢ÃƒÆ’Ã†â€™ÃƒÂ¢Ã¢â€šÂ¬Ã‚Â ÃƒÆ’Ã‚Â¢ÃƒÂ¢Ã¢â‚¬Å¡Ã‚Â¬ÃƒÂ¢Ã¢â‚¬Å¾Ã‚Â¢ÃƒÆ’Ã†â€™Ãƒâ€ Ã¢â‚¬â„¢ÃƒÆ’Ã‚Â¢ÃƒÂ¢Ã¢â‚¬Å¡Ã‚Â¬Ãƒâ€šÃ‚Â ÃƒÆ’Ã†â€™Ãƒâ€šÃ‚Â¢ÃƒÆ’Ã‚Â¢ÃƒÂ¢Ã¢â€šÂ¬Ã…Â¡Ãƒâ€šÃ‚Â¬ÃƒÆ’Ã‚Â¢ÃƒÂ¢Ã¢â€šÂ¬Ã…Â¾Ãƒâ€šÃ‚Â¢ÃƒÆ’Ã†â€™Ãƒâ€ Ã¢â‚¬â„¢ÃƒÆ’Ã¢â‚¬Â ÃƒÂ¢Ã¢â€šÂ¬Ã¢â€žÂ¢ÃƒÆ’Ã†â€™Ãƒâ€šÃ‚Â¢ÃƒÆ’Ã‚Â¢ÃƒÂ¢Ã¢â€šÂ¬Ã…Â¡Ãƒâ€šÃ‚Â¬ÃƒÆ’Ã¢â‚¬Â¦Ãƒâ€šÃ‚Â¡ÃƒÆ’Ã†â€™Ãƒâ€ Ã¢â‚¬â„¢ÃƒÆ’Ã‚Â¢ÃƒÂ¢Ã¢â‚¬Å¡Ã‚Â¬Ãƒâ€¦Ã‚Â¡ÃƒÆ’Ã†â€™ÃƒÂ¢Ã¢â€šÂ¬Ã…Â¡ÃƒÆ’Ã¢â‚¬Å¡Ãƒâ€šÃ‚Â¢ÃƒÆ’Ã†â€™Ãƒâ€ Ã¢â‚¬â„¢ÃƒÆ’Ã¢â‚¬Â ÃƒÂ¢Ã¢â€šÂ¬Ã¢â€žÂ¢ÃƒÆ’Ã†â€™ÃƒÂ¢Ã¢â€šÂ¬Ã‚Â ÃƒÆ’Ã‚Â¢ÃƒÂ¢Ã¢â‚¬Å¡Ã‚Â¬ÃƒÂ¢Ã¢â‚¬Å¾Ã‚Â¢ÃƒÆ’Ã†â€™Ãƒâ€ Ã¢â‚¬â„¢ÃƒÆ’Ã‚Â¢ÃƒÂ¢Ã¢â‚¬Å¡Ã‚Â¬Ãƒâ€¦Ã‚Â¡ÃƒÆ’Ã†â€™ÃƒÂ¢Ã¢â€šÂ¬Ã…Â¡ÃƒÆ’Ã¢â‚¬Å¡Ãƒâ€šÃ‚Â¢ÃƒÆ’Ã†â€™Ãƒâ€ Ã¢â‚¬â„¢ÃƒÆ’Ã¢â‚¬Â ÃƒÂ¢Ã¢â€šÂ¬Ã¢â€žÂ¢ÃƒÆ’Ã†â€™ÃƒÂ¢Ã¢â€šÂ¬Ã…Â¡ÃƒÆ’Ã¢â‚¬Å¡Ãƒâ€šÃ‚Â¢ÃƒÆ’Ã†â€™Ãƒâ€ Ã¢â‚¬â„¢ÃƒÆ’Ã¢â‚¬Å¡Ãƒâ€šÃ‚Â¢ÃƒÆ’Ã†â€™Ãƒâ€šÃ‚Â¢ÃƒÆ’Ã‚Â¢ÃƒÂ¢Ã¢â€šÂ¬Ã…Â¡Ãƒâ€šÃ‚Â¬ÃƒÆ’Ã¢â‚¬Â¦Ãƒâ€šÃ‚Â¡ÃƒÆ’Ã†â€™ÃƒÂ¢Ã¢â€šÂ¬Ã…Â¡ÃƒÆ’Ã¢â‚¬Å¡Ãƒâ€šÃ‚Â¬ÃƒÆ’Ã†â€™Ãƒâ€ Ã¢â‚¬â„¢ÃƒÆ’Ã‚Â¢ÃƒÂ¢Ã¢â‚¬Å¡Ã‚Â¬Ãƒâ€šÃ‚Â¦ÃƒÆ’Ã†â€™ÃƒÂ¢Ã¢â€šÂ¬Ã…Â¡ÃƒÆ’Ã¢â‚¬Å¡Ãƒâ€šÃ‚Â¡ÃƒÆ’Ã†â€™Ãƒâ€ Ã¢â‚¬â„¢ÃƒÆ’Ã¢â‚¬Â ÃƒÂ¢Ã¢â€šÂ¬Ã¢â€žÂ¢ÃƒÆ’Ã†â€™Ãƒâ€šÃ‚Â¢ÃƒÆ’Ã‚Â¢ÃƒÂ¢Ã¢â€šÂ¬Ã…Â¡Ãƒâ€šÃ‚Â¬ÃƒÆ’Ã¢â‚¬Â¦Ãƒâ€šÃ‚Â¡ÃƒÆ’Ã†â€™Ãƒâ€ Ã¢â‚¬â„¢ÃƒÆ’Ã‚Â¢ÃƒÂ¢Ã¢â‚¬Å¡Ã‚Â¬Ãƒâ€¦Ã‚Â¡ÃƒÆ’Ã†â€™ÃƒÂ¢Ã¢â€šÂ¬Ã…Â¡ÃƒÆ’Ã¢â‚¬Å¡Ãƒâ€šÃ‚Â¬ÃƒÆ’Ã†â€™Ãƒâ€ Ã¢â‚¬â„¢ÃƒÆ’Ã¢â‚¬Â ÃƒÂ¢Ã¢â€šÂ¬Ã¢â€žÂ¢ÃƒÆ’Ã†â€™ÃƒÂ¢Ã¢â€šÂ¬Ã‚Â ÃƒÆ’Ã‚Â¢ÃƒÂ¢Ã¢â‚¬Å¡Ã‚Â¬ÃƒÂ¢Ã¢â‚¬Å¾Ã‚Â¢ÃƒÆ’Ã†â€™Ãƒâ€ Ã¢â‚¬â„¢ÃƒÆ’Ã¢â‚¬Å¡Ãƒâ€šÃ‚Â¢ÃƒÆ’Ã†â€™Ãƒâ€šÃ‚Â¢ÃƒÆ’Ã‚Â¢ÃƒÂ¢Ã¢â‚¬Å¡Ã‚Â¬Ãƒâ€¦Ã‚Â¡ÃƒÆ’Ã¢â‚¬Å¡Ãƒâ€šÃ‚Â¬ÃƒÆ’Ã†â€™ÃƒÂ¢Ã¢â€šÂ¬Ã…Â¡ÃƒÆ’Ã¢â‚¬Å¡Ãƒâ€šÃ‚Â¦ÃƒÆ’Ã†â€™Ãƒâ€ Ã¢â‚¬â„¢ÃƒÆ’Ã¢â‚¬Â ÃƒÂ¢Ã¢â€šÂ¬Ã¢â€žÂ¢ÃƒÆ’Ã†â€™Ãƒâ€šÃ‚Â¢ÃƒÆ’Ã‚Â¢ÃƒÂ¢Ã¢â€šÂ¬Ã…Â¡Ãƒâ€šÃ‚Â¬ÃƒÆ’Ã¢â‚¬Â¦Ãƒâ€šÃ‚Â¡ÃƒÆ’Ã†â€™Ãƒâ€ Ã¢â‚¬â„¢ÃƒÆ’Ã‚Â¢ÃƒÂ¢Ã¢â‚¬Å¡Ã‚Â¬Ãƒâ€¦Ã‚Â¡ÃƒÆ’Ã†â€™ÃƒÂ¢Ã¢â€šÂ¬Ã…Â¡ÃƒÆ’Ã¢â‚¬Å¡Ãƒâ€šÃ‚Â¡ÃƒÆ’Ã†â€™Ãƒâ€ Ã¢â‚¬â„¢ÃƒÆ’Ã¢â‚¬Â ÃƒÂ¢Ã¢â€šÂ¬Ã¢â€žÂ¢ÃƒÆ’Ã†â€™ÃƒÂ¢Ã¢â€šÂ¬Ã‚Â ÃƒÆ’Ã‚Â¢ÃƒÂ¢Ã¢â‚¬Å¡Ã‚Â¬ÃƒÂ¢Ã¢â‚¬Å¾Ã‚Â¢ÃƒÆ’Ã†â€™Ãƒâ€ Ã¢â‚¬â„¢ÃƒÆ’Ã‚Â¢ÃƒÂ¢Ã¢â‚¬Å¡Ã‚Â¬Ãƒâ€šÃ‚Â ÃƒÆ’Ã†â€™Ãƒâ€šÃ‚Â¢ÃƒÆ’Ã‚Â¢ÃƒÂ¢Ã¢â€šÂ¬Ã…Â¡Ãƒâ€šÃ‚Â¬ÃƒÆ’Ã‚Â¢ÃƒÂ¢Ã¢â€šÂ¬Ã…Â¾Ãƒâ€šÃ‚Â¢ÃƒÆ’Ã†â€™Ãƒâ€ Ã¢â‚¬â„¢ÃƒÆ’Ã¢â‚¬Â ÃƒÂ¢Ã¢â€šÂ¬Ã¢â€žÂ¢ÃƒÆ’Ã†â€™Ãƒâ€šÃ‚Â¢ÃƒÆ’Ã‚Â¢ÃƒÂ¢Ã¢â€šÂ¬Ã…Â¡Ãƒâ€šÃ‚Â¬ÃƒÆ’Ã¢â‚¬Å¡Ãƒâ€šÃ‚Â ÃƒÆ’Ã†â€™Ãƒâ€ Ã¢â‚¬â„¢ÃƒÆ’Ã¢â‚¬Å¡Ãƒâ€šÃ‚Â¢ÃƒÆ’Ã†â€™Ãƒâ€šÃ‚Â¢ÃƒÆ’Ã‚Â¢ÃƒÂ¢Ã¢â‚¬Å¡Ã‚Â¬Ãƒâ€¦Ã‚Â¡ÃƒÆ’Ã¢â‚¬Å¡Ãƒâ€šÃ‚Â¬ÃƒÆ’Ã†â€™Ãƒâ€šÃ‚Â¢ÃƒÆ’Ã‚Â¢ÃƒÂ¢Ã¢â‚¬Å¡Ã‚Â¬Ãƒâ€¦Ã‚Â¾ÃƒÆ’Ã¢â‚¬Å¡Ãƒâ€šÃ‚Â¢ÃƒÆ’Ã†â€™Ãƒâ€ Ã¢â‚¬â„¢ÃƒÆ’Ã¢â‚¬Â ÃƒÂ¢Ã¢â€šÂ¬Ã¢â€žÂ¢ÃƒÆ’Ã†â€™ÃƒÂ¢Ã¢â€šÂ¬Ã‚Â ÃƒÆ’Ã‚Â¢ÃƒÂ¢Ã¢â‚¬Å¡Ã‚Â¬ÃƒÂ¢Ã¢â‚¬Å¾Ã‚Â¢ÃƒÆ’Ã†â€™Ãƒâ€ Ã¢â‚¬â„¢ÃƒÆ’Ã‚Â¢ÃƒÂ¢Ã¢â‚¬Å¡Ã‚Â¬Ãƒâ€¦Ã‚Â¡ÃƒÆ’Ã†â€™ÃƒÂ¢Ã¢â€šÂ¬Ã…Â¡ÃƒÆ’Ã¢â‚¬Å¡Ãƒâ€šÃ‚Â¢ÃƒÆ’Ã†â€™Ãƒâ€ Ã¢â‚¬â„¢ÃƒÆ’Ã¢â‚¬Â ÃƒÂ¢Ã¢â€šÂ¬Ã¢â€žÂ¢ÃƒÆ’Ã†â€™ÃƒÂ¢Ã¢â€šÂ¬Ã…Â¡ÃƒÆ’Ã¢â‚¬Å¡Ãƒâ€šÃ‚Â¢ÃƒÆ’Ã†â€™Ãƒâ€ Ã¢â‚¬â„¢ÃƒÆ’Ã¢â‚¬Å¡Ãƒâ€šÃ‚Â¢ÃƒÆ’Ã†â€™Ãƒâ€šÃ‚Â¢ÃƒÆ’Ã‚Â¢ÃƒÂ¢Ã¢â‚¬Å¡Ã‚Â¬Ãƒâ€¦Ã‚Â¡ÃƒÆ’Ã¢â‚¬Å¡Ãƒâ€šÃ‚Â¬ÃƒÆ’Ã†â€™ÃƒÂ¢Ã¢â€šÂ¬Ã‚Â¦ÃƒÆ’Ã¢â‚¬Å¡Ãƒâ€šÃ‚Â¡ÃƒÆ’Ã†â€™Ãƒâ€ Ã¢â‚¬â„¢ÃƒÆ’Ã‚Â¢ÃƒÂ¢Ã¢â‚¬Å¡Ã‚Â¬Ãƒâ€¦Ã‚Â¡ÃƒÆ’Ã†â€™ÃƒÂ¢Ã¢â€šÂ¬Ã…Â¡ÃƒÆ’Ã¢â‚¬Å¡Ãƒâ€šÃ‚Â¬ÃƒÆ’Ã†â€™Ãƒâ€ Ã¢â‚¬â„¢ÃƒÆ’Ã¢â‚¬Â ÃƒÂ¢Ã¢â€šÂ¬Ã¢â€žÂ¢ÃƒÆ’Ã†â€™Ãƒâ€šÃ‚Â¢ÃƒÆ’Ã‚Â¢ÃƒÂ¢Ã¢â€šÂ¬Ã…Â¡Ãƒâ€šÃ‚Â¬ÃƒÆ’Ã¢â‚¬Å¡Ãƒâ€šÃ‚Â¦ÃƒÆ’Ã†â€™Ãƒâ€ Ã¢â‚¬â„¢ÃƒÆ’Ã‚Â¢ÃƒÂ¢Ã¢â‚¬Å¡Ã‚Â¬Ãƒâ€¦Ã‚Â¡ÃƒÆ’Ã†â€™ÃƒÂ¢Ã¢â€šÂ¬Ã…Â¡ÃƒÆ’Ã¢â‚¬Å¡Ãƒâ€šÃ‚Â¡ÃƒÆ’Ã†â€™Ãƒâ€ Ã¢â‚¬â„¢ÃƒÆ’Ã¢â‚¬Â ÃƒÂ¢Ã¢â€šÂ¬Ã¢â€žÂ¢ÃƒÆ’Ã†â€™ÃƒÂ¢Ã¢â€šÂ¬Ã‚Â ÃƒÆ’Ã‚Â¢ÃƒÂ¢Ã¢â‚¬Å¡Ã‚Â¬ÃƒÂ¢Ã¢â‚¬Å¾Ã‚Â¢ÃƒÆ’Ã†â€™Ãƒâ€ Ã¢â‚¬â„¢ÃƒÆ’Ã‚Â¢ÃƒÂ¢Ã¢â‚¬Å¡Ã‚Â¬Ãƒâ€šÃ‚Â ÃƒÆ’Ã†â€™Ãƒâ€šÃ‚Â¢ÃƒÆ’Ã‚Â¢ÃƒÂ¢Ã¢â€šÂ¬Ã…Â¡Ãƒâ€šÃ‚Â¬ÃƒÆ’Ã‚Â¢ÃƒÂ¢Ã¢â€šÂ¬Ã…Â¾Ãƒâ€šÃ‚Â¢ÃƒÆ’Ã†â€™Ãƒâ€ Ã¢â‚¬â„¢ÃƒÆ’Ã¢â‚¬Â ÃƒÂ¢Ã¢â€šÂ¬Ã¢â€žÂ¢ÃƒÆ’Ã†â€™ÃƒÂ¢Ã¢â€šÂ¬Ã…Â¡ÃƒÆ’Ã¢â‚¬Å¡Ãƒâ€šÃ‚Â¢ÃƒÆ’Ã†â€™Ãƒâ€ Ã¢â‚¬â„¢ÃƒÆ’Ã¢â‚¬Å¡Ãƒâ€šÃ‚Â¢ÃƒÆ’Ã†â€™Ãƒâ€šÃ‚Â¢ÃƒÆ’Ã‚Â¢ÃƒÂ¢Ã¢â€šÂ¬Ã…Â¡Ãƒâ€šÃ‚Â¬ÃƒÆ’Ã¢â‚¬Â¦Ãƒâ€šÃ‚Â¡ÃƒÆ’Ã†â€™ÃƒÂ¢Ã¢â€šÂ¬Ã…Â¡ÃƒÆ’Ã¢â‚¬Å¡Ãƒâ€šÃ‚Â¬ÃƒÆ’Ã†â€™Ãƒâ€ Ã¢â‚¬â„¢ÃƒÆ’Ã‚Â¢ÃƒÂ¢Ã¢â‚¬Å¡Ã‚Â¬Ãƒâ€šÃ‚Â¦ÃƒÆ’Ã†â€™ÃƒÂ¢Ã¢â€šÂ¬Ã…Â¡ÃƒÆ’Ã¢â‚¬Å¡Ãƒâ€šÃ‚Â¡ÃƒÆ’Ã†â€™Ãƒâ€ Ã¢â‚¬â„¢ÃƒÆ’Ã¢â‚¬Â ÃƒÂ¢Ã¢â€šÂ¬Ã¢â€žÂ¢ÃƒÆ’Ã†â€™ÃƒÂ¢Ã¢â€šÂ¬Ã‚Â ÃƒÆ’Ã‚Â¢ÃƒÂ¢Ã¢â‚¬Å¡Ã‚Â¬ÃƒÂ¢Ã¢â‚¬Å¾Ã‚Â¢ÃƒÆ’Ã†â€™Ãƒâ€ Ã¢â‚¬â„¢ÃƒÆ’Ã¢â‚¬Å¡Ãƒâ€šÃ‚Â¢ÃƒÆ’Ã†â€™Ãƒâ€šÃ‚Â¢ÃƒÆ’Ã‚Â¢ÃƒÂ¢Ã¢â‚¬Å¡Ã‚Â¬Ãƒâ€¦Ã‚Â¡ÃƒÆ’Ã¢â‚¬Å¡Ãƒâ€šÃ‚Â¬ÃƒÆ’Ã†â€™ÃƒÂ¢Ã¢â€šÂ¬Ã‚Â¦ÃƒÆ’Ã¢â‚¬Å¡Ãƒâ€šÃ‚Â¡ÃƒÆ’Ã†â€™Ãƒâ€ Ã¢â‚¬â„¢ÃƒÆ’Ã¢â‚¬Â ÃƒÂ¢Ã¢â€šÂ¬Ã¢â€žÂ¢ÃƒÆ’Ã†â€™Ãƒâ€šÃ‚Â¢ÃƒÆ’Ã‚Â¢ÃƒÂ¢Ã¢â€šÂ¬Ã…Â¡Ãƒâ€šÃ‚Â¬ÃƒÆ’Ã¢â‚¬Â¦Ãƒâ€šÃ‚Â¡ÃƒÆ’Ã†â€™Ãƒâ€ Ã¢â‚¬â„¢ÃƒÆ’Ã‚Â¢ÃƒÂ¢Ã¢â‚¬Å¡Ã‚Â¬Ãƒâ€¦Ã‚Â¡ÃƒÆ’Ã†â€™ÃƒÂ¢Ã¢â€šÂ¬Ã…Â¡ÃƒÆ’Ã¢â‚¬Å¡Ãƒâ€šÃ‚Â°C) in two aquaculture systems, Integrated Multi-Trophic Aquaculture (IMTA) and Monoculture, over a seven-week period. Overall, both treatments exhibited a very similar pattern of fluctuation throughout the study. At the beginning (Week 1), water temperature was relatively high in both systems, with Monoculture showing a slightly higher value (approximately 28.7ÃƒÆ’Ã†â€™Ãƒâ€ Ã¢â‚¬â„¢ÃƒÆ’Ã¢â‚¬Â ÃƒÂ¢Ã¢â€šÂ¬Ã¢â€žÂ¢ÃƒÆ’Ã†â€™ÃƒÂ¢Ã¢â€šÂ¬Ã‚Â ÃƒÆ’Ã‚Â¢ÃƒÂ¢Ã¢â‚¬Å¡Ã‚Â¬ÃƒÂ¢Ã¢â‚¬Å¾Ã‚Â¢ÃƒÆ’Ã†â€™Ãƒâ€ Ã¢â‚¬â„¢ÃƒÆ’Ã‚Â¢ÃƒÂ¢Ã¢â‚¬Å¡Ã‚Â¬Ãƒâ€šÃ‚Â ÃƒÆ’Ã†â€™Ãƒâ€šÃ‚Â¢ÃƒÆ’Ã‚Â¢ÃƒÂ¢Ã¢â€šÂ¬Ã…Â¡Ãƒâ€šÃ‚Â¬ÃƒÆ’Ã‚Â¢ÃƒÂ¢Ã¢â€šÂ¬Ã…Â¾Ãƒâ€šÃ‚Â¢ÃƒÆ’Ã†â€™Ãƒâ€ Ã¢â‚¬â„¢ÃƒÆ’Ã¢â‚¬Â ÃƒÂ¢Ã¢â€šÂ¬Ã¢â€žÂ¢ÃƒÆ’Ã†â€™Ãƒâ€šÃ‚Â¢ÃƒÆ’Ã‚Â¢ÃƒÂ¢Ã¢â€šÂ¬Ã…Â¡Ãƒâ€šÃ‚Â¬ÃƒÆ’Ã¢â‚¬Å¡Ãƒâ€šÃ‚Â ÃƒÆ’Ã†â€™Ãƒâ€ Ã¢â‚¬â„¢ÃƒÆ’Ã¢â‚¬Å¡Ãƒâ€šÃ‚Â¢ÃƒÆ’Ã†â€™Ãƒâ€šÃ‚Â¢ÃƒÆ’Ã‚Â¢ÃƒÂ¢Ã¢â‚¬Å¡Ã‚Â¬Ãƒâ€¦Ã‚Â¡ÃƒÆ’Ã¢â‚¬Å¡Ãƒâ€šÃ‚Â¬ÃƒÆ’Ã†â€™Ãƒâ€šÃ‚Â¢ÃƒÆ’Ã‚Â¢ÃƒÂ¢Ã¢â‚¬Å¡Ã‚Â¬Ãƒâ€¦Ã‚Â¾ÃƒÆ’Ã¢â‚¬Å¡Ãƒâ€šÃ‚Â¢ÃƒÆ’Ã†â€™Ãƒâ€ Ã¢â‚¬â„¢ÃƒÆ’Ã¢â‚¬Â ÃƒÂ¢Ã¢â€šÂ¬Ã¢â€žÂ¢ÃƒÆ’Ã†â€™ÃƒÂ¢Ã¢â€šÂ¬Ã‚Â ÃƒÆ’Ã‚Â¢ÃƒÂ¢Ã¢â‚¬Å¡Ã‚Â¬ÃƒÂ¢Ã¢â‚¬Å¾Ã‚Â¢ÃƒÆ’Ã†â€™Ãƒâ€ Ã¢â‚¬â„¢ÃƒÆ’Ã¢â‚¬Å¡Ãƒâ€šÃ‚Â¢ÃƒÆ’Ã†â€™Ãƒâ€šÃ‚Â¢ÃƒÆ’Ã‚Â¢ÃƒÂ¢Ã¢â‚¬Å¡Ã‚Â¬Ãƒâ€¦Ã‚Â¡ÃƒÆ’Ã¢â‚¬Å¡Ãƒâ€šÃ‚Â¬ÃƒÆ’Ã†â€™ÃƒÂ¢Ã¢â€šÂ¬Ã…Â¡ÃƒÆ’Ã¢â‚¬Å¡Ãƒâ€šÃ‚Â ÃƒÆ’Ã†â€™Ãƒâ€ Ã¢â‚¬â„¢ÃƒÆ’Ã¢â‚¬Â ÃƒÂ¢Ã¢â€šÂ¬Ã¢â€žÂ¢ÃƒÆ’Ã†â€™ÃƒÂ¢Ã¢â€šÂ¬Ã…Â¡ÃƒÆ’Ã¢â‚¬Å¡Ãƒâ€šÃ‚Â¢ÃƒÆ’Ã†â€™Ãƒâ€ Ã¢â‚¬â„¢ÃƒÆ’Ã¢â‚¬Å¡Ãƒâ€šÃ‚Â¢ÃƒÆ’Ã†â€™Ãƒâ€šÃ‚Â¢ÃƒÆ’Ã‚Â¢ÃƒÂ¢Ã¢â€šÂ¬Ã…Â¡Ãƒâ€šÃ‚Â¬ÃƒÆ’Ã¢â‚¬Â¦Ãƒâ€šÃ‚Â¡ÃƒÆ’Ã†â€™ÃƒÂ¢Ã¢â€šÂ¬Ã…Â¡ÃƒÆ’Ã¢â‚¬Å¡Ãƒâ€šÃ‚Â¬ÃƒÆ’Ã†â€™Ãƒâ€ Ã¢â‚¬â„¢ÃƒÆ’Ã¢â‚¬Å¡Ãƒâ€šÃ‚Â¢ÃƒÆ’Ã†â€™Ãƒâ€šÃ‚Â¢ÃƒÆ’Ã‚Â¢ÃƒÂ¢Ã¢â€šÂ¬Ã…Â¡Ãƒâ€šÃ‚Â¬ÃƒÆ’Ã¢â‚¬Â¦Ãƒâ€šÃ‚Â¾ÃƒÆ’Ã†â€™ÃƒÂ¢Ã¢â€šÂ¬Ã…Â¡ÃƒÆ’Ã¢â‚¬Å¡Ãƒâ€šÃ‚Â¢ÃƒÆ’Ã†â€™Ãƒâ€ Ã¢â‚¬â„¢ÃƒÆ’Ã¢â‚¬Â ÃƒÂ¢Ã¢â€šÂ¬Ã¢â€žÂ¢ÃƒÆ’Ã†â€™ÃƒÂ¢Ã¢â€šÂ¬Ã‚Â ÃƒÆ’Ã‚Â¢ÃƒÂ¢Ã¢â‚¬Å¡Ã‚Â¬ÃƒÂ¢Ã¢â‚¬Å¾Ã‚Â¢ÃƒÆ’Ã†â€™Ãƒâ€ Ã¢â‚¬â„¢ÃƒÆ’Ã‚Â¢ÃƒÂ¢Ã¢â‚¬Å¡Ã‚Â¬Ãƒâ€šÃ‚Â ÃƒÆ’Ã†â€™Ãƒâ€šÃ‚Â¢ÃƒÆ’Ã‚Â¢ÃƒÂ¢Ã¢â€šÂ¬Ã…Â¡Ãƒâ€šÃ‚Â¬ÃƒÆ’Ã‚Â¢ÃƒÂ¢Ã¢â€šÂ¬Ã…Â¾Ãƒâ€šÃ‚Â¢ÃƒÆ’Ã†â€™Ãƒâ€ Ã¢â‚¬â„¢ÃƒÆ’Ã¢â‚¬Â ÃƒÂ¢Ã¢â€šÂ¬Ã¢â€žÂ¢ÃƒÆ’Ã†â€™Ãƒâ€šÃ‚Â¢ÃƒÆ’Ã‚Â¢ÃƒÂ¢Ã¢â€šÂ¬Ã…Â¡Ãƒâ€šÃ‚Â¬ÃƒÆ’Ã¢â‚¬Â¦Ãƒâ€šÃ‚Â¡ÃƒÆ’Ã†â€™Ãƒâ€ Ã¢â‚¬â„¢ÃƒÆ’Ã‚Â¢ÃƒÂ¢Ã¢â‚¬Å¡Ã‚Â¬Ãƒâ€¦Ã‚Â¡ÃƒÆ’Ã†â€™ÃƒÂ¢Ã¢â€šÂ¬Ã…Â¡ÃƒÆ’Ã¢â‚¬Å¡Ãƒâ€šÃ‚Â¢ÃƒÆ’Ã†â€™Ãƒâ€ Ã¢â‚¬â„¢ÃƒÆ’Ã¢â‚¬Â ÃƒÂ¢Ã¢â€šÂ¬Ã¢â€žÂ¢ÃƒÆ’Ã†â€™ÃƒÂ¢Ã¢â€šÂ¬Ã‚Â ÃƒÆ’Ã‚Â¢ÃƒÂ¢Ã¢â‚¬Å¡Ã‚Â¬ÃƒÂ¢Ã¢â‚¬Å¾Ã‚Â¢ÃƒÆ’Ã†â€™Ãƒâ€ Ã¢â‚¬â„¢ÃƒÆ’Ã‚Â¢ÃƒÂ¢Ã¢â‚¬Å¡Ã‚Â¬Ãƒâ€¦Ã‚Â¡ÃƒÆ’Ã†â€™ÃƒÂ¢Ã¢â€šÂ¬Ã…Â¡ÃƒÆ’Ã¢â‚¬Å¡Ãƒâ€šÃ‚Â¢ÃƒÆ’Ã†â€™Ãƒâ€ Ã¢â‚¬â„¢ÃƒÆ’Ã¢â‚¬Â ÃƒÂ¢Ã¢â€šÂ¬Ã¢â€žÂ¢ÃƒÆ’Ã†â€™ÃƒÂ¢Ã¢â€šÂ¬Ã…Â¡ÃƒÆ’Ã¢â‚¬Å¡Ãƒâ€šÃ‚Â¢ÃƒÆ’Ã†â€™Ãƒâ€ Ã¢â‚¬â„¢ÃƒÆ’Ã¢â‚¬Å¡Ãƒâ€šÃ‚Â¢ÃƒÆ’Ã†â€™Ãƒâ€šÃ‚Â¢ÃƒÆ’Ã‚Â¢ÃƒÂ¢Ã¢â€šÂ¬Ã…Â¡Ãƒâ€šÃ‚Â¬ÃƒÆ’Ã¢â‚¬Â¦Ãƒâ€šÃ‚Â¡ÃƒÆ’Ã†â€™ÃƒÂ¢Ã¢â€šÂ¬Ã…Â¡ÃƒÆ’Ã¢â‚¬Å¡Ãƒâ€šÃ‚Â¬ÃƒÆ’Ã†â€™Ãƒâ€ Ã¢â‚¬â„¢ÃƒÆ’Ã‚Â¢ÃƒÂ¢Ã¢â‚¬Å¡Ã‚Â¬Ãƒâ€šÃ‚Â¦ÃƒÆ’Ã†â€™ÃƒÂ¢Ã¢â€šÂ¬Ã…Â¡ÃƒÆ’Ã¢â‚¬Å¡Ãƒâ€šÃ‚Â¡ÃƒÆ’Ã†â€™Ãƒâ€ Ã¢â‚¬â„¢ÃƒÆ’Ã¢â‚¬Â ÃƒÂ¢Ã¢â€šÂ¬Ã¢â€žÂ¢ÃƒÆ’Ã†â€™Ãƒâ€šÃ‚Â¢ÃƒÆ’Ã‚Â¢ÃƒÂ¢Ã¢â€šÂ¬Ã…Â¡Ãƒâ€šÃ‚Â¬ÃƒÆ’Ã¢â‚¬Â¦Ãƒâ€šÃ‚Â¡ÃƒÆ’Ã†â€™Ãƒâ€ Ã¢â‚¬â„¢ÃƒÆ’Ã‚Â¢ÃƒÂ¢Ã¢â‚¬Å¡Ã‚Â¬Ãƒâ€¦Ã‚Â¡ÃƒÆ’Ã†â€™ÃƒÂ¢Ã¢â€šÂ¬Ã…Â¡ÃƒÆ’Ã¢â‚¬Å¡Ãƒâ€šÃ‚Â¬ÃƒÆ’Ã†â€™Ãƒâ€ Ã¢â‚¬â„¢ÃƒÆ’Ã¢â‚¬Â ÃƒÂ¢Ã¢â€šÂ¬Ã¢â€žÂ¢ÃƒÆ’Ã†â€™ÃƒÂ¢Ã¢â€šÂ¬Ã‚Â ÃƒÆ’Ã‚Â¢ÃƒÂ¢Ã¢â‚¬Å¡Ã‚Â¬ÃƒÂ¢Ã¢â‚¬Å¾Ã‚Â¢ÃƒÆ’Ã†â€™Ãƒâ€ Ã¢â‚¬â„¢ÃƒÆ’Ã¢â‚¬Å¡Ãƒâ€šÃ‚Â¢ÃƒÆ’Ã†â€™Ãƒâ€šÃ‚Â¢ÃƒÆ’Ã‚Â¢ÃƒÂ¢Ã¢â‚¬Å¡Ã‚Â¬Ãƒâ€¦Ã‚Â¡ÃƒÆ’Ã¢â‚¬Å¡Ãƒâ€šÃ‚Â¬ÃƒÆ’Ã†â€™ÃƒÂ¢Ã¢â€šÂ¬Ã…Â¡ÃƒÆ’Ã¢â‚¬Å¡Ãƒâ€šÃ‚Â¦ÃƒÆ’Ã†â€™Ãƒâ€ Ã¢â‚¬â„¢ÃƒÆ’Ã¢â‚¬Â ÃƒÂ¢Ã¢â€šÂ¬Ã¢â€žÂ¢ÃƒÆ’Ã†â€™Ãƒâ€šÃ‚Â¢ÃƒÆ’Ã‚Â¢ÃƒÂ¢Ã¢â€šÂ¬Ã…Â¡Ãƒâ€šÃ‚Â¬ÃƒÆ’Ã¢â‚¬Â¦Ãƒâ€šÃ‚Â¡ÃƒÆ’Ã†â€™Ãƒâ€ Ã¢â‚¬â„¢ÃƒÆ’Ã‚Â¢ÃƒÂ¢Ã¢â‚¬Å¡Ã‚Â¬Ãƒâ€¦Ã‚Â¡ÃƒÆ’Ã†â€™ÃƒÂ¢Ã¢â€šÂ¬Ã…Â¡ÃƒÆ’Ã¢â‚¬Å¡Ãƒâ€šÃ‚Â¡ÃƒÆ’Ã†â€™Ãƒâ€ Ã¢â‚¬â„¢ÃƒÆ’Ã¢â‚¬Â ÃƒÂ¢Ã¢â€šÂ¬Ã¢â€žÂ¢ÃƒÆ’Ã†â€™ÃƒÂ¢Ã¢â€šÂ¬Ã‚Â ÃƒÆ’Ã‚Â¢ÃƒÂ¢Ã¢â‚¬Å¡Ã‚Â¬ÃƒÂ¢Ã¢â‚¬Å¾Ã‚Â¢ÃƒÆ’Ã†â€™Ãƒâ€ Ã¢â‚¬â„¢ÃƒÆ’Ã‚Â¢ÃƒÂ¢Ã¢â‚¬Å¡Ã‚Â¬Ãƒâ€šÃ‚Â ÃƒÆ’Ã†â€™Ãƒâ€šÃ‚Â¢ÃƒÆ’Ã‚Â¢ÃƒÂ¢Ã¢â€šÂ¬Ã…Â¡Ãƒâ€šÃ‚Â¬ÃƒÆ’Ã‚Â¢ÃƒÂ¢Ã¢â€šÂ¬Ã…Â¾Ãƒâ€šÃ‚Â¢ÃƒÆ’Ã†â€™Ãƒâ€ Ã¢â‚¬â„¢ÃƒÆ’Ã¢â‚¬Â ÃƒÂ¢Ã¢â€šÂ¬Ã¢â€žÂ¢ÃƒÆ’Ã†â€™Ãƒâ€šÃ‚Â¢ÃƒÆ’Ã‚Â¢ÃƒÂ¢Ã¢â€šÂ¬Ã…Â¡Ãƒâ€šÃ‚Â¬ÃƒÆ’Ã¢â‚¬Å¡Ãƒâ€šÃ‚Â ÃƒÆ’Ã†â€™Ãƒâ€ Ã¢â‚¬â„¢ÃƒÆ’Ã¢â‚¬Å¡Ãƒâ€šÃ‚Â¢ÃƒÆ’Ã†â€™Ãƒâ€šÃ‚Â¢ÃƒÆ’Ã‚Â¢ÃƒÂ¢Ã¢â‚¬Å¡Ã‚Â¬Ãƒâ€¦Ã‚Â¡ÃƒÆ’Ã¢â‚¬Å¡Ãƒâ€šÃ‚Â¬ÃƒÆ’Ã†â€™Ãƒâ€šÃ‚Â¢ÃƒÆ’Ã‚Â¢ÃƒÂ¢Ã¢â‚¬Å¡Ã‚Â¬Ãƒâ€¦Ã‚Â¾ÃƒÆ’Ã¢â‚¬Å¡Ãƒâ€šÃ‚Â¢ÃƒÆ’Ã†â€™Ãƒâ€ Ã¢â‚¬â„¢ÃƒÆ’Ã¢â‚¬Â ÃƒÂ¢Ã¢â€šÂ¬Ã¢â€žÂ¢ÃƒÆ’Ã†â€™ÃƒÂ¢Ã¢â€šÂ¬Ã‚Â ÃƒÆ’Ã‚Â¢ÃƒÂ¢Ã¢â‚¬Å¡Ã‚Â¬ÃƒÂ¢Ã¢â‚¬Å¾Ã‚Â¢ÃƒÆ’Ã†â€™Ãƒâ€ Ã¢â‚¬â„¢ÃƒÆ’Ã‚Â¢ÃƒÂ¢Ã¢â‚¬Å¡Ã‚Â¬Ãƒâ€¦Ã‚Â¡ÃƒÆ’Ã†â€™ÃƒÂ¢Ã¢â€šÂ¬Ã…Â¡ÃƒÆ’Ã¢â‚¬Å¡Ãƒâ€šÃ‚Â¢ÃƒÆ’Ã†â€™Ãƒâ€ Ã¢â‚¬â„¢ÃƒÆ’Ã¢â‚¬Â ÃƒÂ¢Ã¢â€šÂ¬Ã¢â€žÂ¢ÃƒÆ’Ã†â€™ÃƒÂ¢Ã¢â€šÂ¬Ã…Â¡ÃƒÆ’Ã¢â‚¬Å¡Ãƒâ€šÃ‚Â¢ÃƒÆ’Ã†â€™Ãƒâ€ Ã¢â‚¬â„¢ÃƒÆ’Ã¢â‚¬Å¡Ãƒâ€šÃ‚Â¢ÃƒÆ’Ã†â€™Ãƒâ€šÃ‚Â¢ÃƒÆ’Ã‚Â¢ÃƒÂ¢Ã¢â‚¬Å¡Ã‚Â¬Ãƒâ€¦Ã‚Â¡ÃƒÆ’Ã¢â‚¬Å¡Ãƒâ€šÃ‚Â¬ÃƒÆ’Ã†â€™ÃƒÂ¢Ã¢â€šÂ¬Ã‚Â¦ÃƒÆ’Ã¢â‚¬Å¡Ãƒâ€šÃ‚Â¡ÃƒÆ’Ã†â€™Ãƒâ€ Ã¢â‚¬â„¢ÃƒÆ’Ã‚Â¢ÃƒÂ¢Ã¢â‚¬Å¡Ã‚Â¬Ãƒâ€¦Ã‚Â¡ÃƒÆ’Ã†â€™ÃƒÂ¢Ã¢â€šÂ¬Ã…Â¡ÃƒÆ’Ã¢â‚¬Å¡Ãƒâ€šÃ‚Â¬ÃƒÆ’Ã†â€™Ãƒâ€ Ã¢â‚¬â„¢ÃƒÆ’Ã¢â‚¬Â ÃƒÂ¢Ã¢â€šÂ¬Ã¢â€žÂ¢ÃƒÆ’Ã†â€™Ãƒâ€šÃ‚Â¢ÃƒÆ’Ã‚Â¢ÃƒÂ¢Ã¢â€šÂ¬Ã…Â¡Ãƒâ€šÃ‚Â¬ÃƒÆ’Ã¢â‚¬Å¡Ãƒâ€šÃ‚Â¦ÃƒÆ’Ã†â€™Ãƒâ€ Ã¢â‚¬â„¢ÃƒÆ’Ã‚Â¢ÃƒÂ¢Ã¢â‚¬Å¡Ã‚Â¬Ãƒâ€¦Ã‚Â¡ÃƒÆ’Ã†â€™ÃƒÂ¢Ã¢â€šÂ¬Ã…Â¡ÃƒÆ’Ã¢â‚¬Å¡Ãƒâ€šÃ‚Â¡ÃƒÆ’Ã†â€™Ãƒâ€ Ã¢â‚¬â„¢ÃƒÆ’Ã¢â‚¬Â ÃƒÂ¢Ã¢â€šÂ¬Ã¢â€žÂ¢ÃƒÆ’Ã†â€™ÃƒÂ¢Ã¢â€šÂ¬Ã‚Â ÃƒÆ’Ã‚Â¢ÃƒÂ¢Ã¢â‚¬Å¡Ã‚Â¬ÃƒÂ¢Ã¢â‚¬Å¾Ã‚Â¢ÃƒÆ’Ã†â€™Ãƒâ€ Ã¢â‚¬â„¢ÃƒÆ’Ã‚Â¢ÃƒÂ¢Ã¢â‚¬Å¡Ã‚Â¬Ãƒâ€šÃ‚Â ÃƒÆ’Ã†â€™Ãƒâ€šÃ‚Â¢ÃƒÆ’Ã‚Â¢ÃƒÂ¢Ã¢â€šÂ¬Ã…Â¡Ãƒâ€šÃ‚Â¬ÃƒÆ’Ã‚Â¢ÃƒÂ¢Ã¢â€šÂ¬Ã…Â¾Ãƒâ€šÃ‚Â¢ÃƒÆ’Ã†â€™Ãƒâ€ Ã¢â‚¬â„¢ÃƒÆ’Ã¢â‚¬Â ÃƒÂ¢Ã¢â€šÂ¬Ã¢â€žÂ¢ÃƒÆ’Ã†â€™ÃƒÂ¢Ã¢â€šÂ¬Ã…Â¡ÃƒÆ’Ã¢â‚¬Å¡Ãƒâ€šÃ‚Â¢ÃƒÆ’Ã†â€™Ãƒâ€ Ã¢â‚¬â„¢ÃƒÆ’Ã¢â‚¬Å¡Ãƒâ€šÃ‚Â¢ÃƒÆ’Ã†â€™Ãƒâ€šÃ‚Â¢ÃƒÆ’Ã‚Â¢ÃƒÂ¢Ã¢â€šÂ¬Ã…Â¡Ãƒâ€šÃ‚Â¬ÃƒÆ’Ã¢â‚¬Â¦Ãƒâ€šÃ‚Â¡ÃƒÆ’Ã†â€™ÃƒÂ¢Ã¢â€šÂ¬Ã…Â¡ÃƒÆ’Ã¢â‚¬Å¡Ãƒâ€šÃ‚Â¬ÃƒÆ’Ã†â€™Ãƒâ€ Ã¢â‚¬â„¢ÃƒÆ’Ã‚Â¢ÃƒÂ¢Ã¢â‚¬Å¡Ã‚Â¬Ãƒâ€šÃ‚Â¦ÃƒÆ’Ã†â€™ÃƒÂ¢Ã¢â€šÂ¬Ã…Â¡ÃƒÆ’Ã¢â‚¬Å¡Ãƒâ€šÃ‚Â¡ÃƒÆ’Ã†â€™Ãƒâ€ Ã¢â‚¬â„¢ÃƒÆ’Ã¢â‚¬Â ÃƒÂ¢Ã¢â€šÂ¬Ã¢â€žÂ¢ÃƒÆ’Ã†â€™ÃƒÂ¢Ã¢â€šÂ¬Ã‚Â ÃƒÆ’Ã‚Â¢ÃƒÂ¢Ã¢â‚¬Å¡Ã‚Â¬ÃƒÂ¢Ã¢â‚¬Å¾Ã‚Â¢ÃƒÆ’Ã†â€™Ãƒâ€ Ã¢â‚¬â„¢ÃƒÆ’Ã¢â‚¬Å¡Ãƒâ€šÃ‚Â¢ÃƒÆ’Ã†â€™Ãƒâ€šÃ‚Â¢ÃƒÆ’Ã‚Â¢ÃƒÂ¢Ã¢â‚¬Å¡Ã‚Â¬Ãƒâ€¦Ã‚Â¡ÃƒÆ’Ã¢â‚¬Å¡Ãƒâ€šÃ‚Â¬ÃƒÆ’Ã†â€™ÃƒÂ¢Ã¢â€šÂ¬Ã‚Â¦ÃƒÆ’Ã¢â‚¬Å¡Ãƒâ€šÃ‚Â¡ÃƒÆ’Ã†â€™Ãƒâ€ Ã¢â‚¬â„¢ÃƒÆ’Ã¢â‚¬Â ÃƒÂ¢Ã¢â€šÂ¬Ã¢â€žÂ¢ÃƒÆ’Ã†â€™Ãƒâ€šÃ‚Â¢ÃƒÆ’Ã‚Â¢ÃƒÂ¢Ã¢â€šÂ¬Ã…Â¡Ãƒâ€šÃ‚Â¬ÃƒÆ’Ã¢â‚¬Â¦Ãƒâ€šÃ‚Â¡ÃƒÆ’Ã†â€™Ãƒâ€ Ã¢â‚¬â„¢ÃƒÆ’Ã‚Â¢ÃƒÂ¢Ã¢â‚¬Å¡Ã‚Â¬Ãƒâ€¦Ã‚Â¡ÃƒÆ’Ã†â€™ÃƒÂ¢Ã¢â€šÂ¬Ã…Â¡ÃƒÆ’Ã¢â‚¬Å¡Ãƒâ€šÃ‚Â°C) compared to IMTA (around 28.2ÃƒÆ’Ã†â€™Ãƒâ€ Ã¢â‚¬â„¢ÃƒÆ’Ã¢â‚¬Â ÃƒÂ¢Ã¢â€šÂ¬Ã¢â€žÂ¢ÃƒÆ’Ã†â€™ÃƒÂ¢Ã¢â€šÂ¬Ã‚Â ÃƒÆ’Ã‚Â¢ÃƒÂ¢Ã¢â‚¬Å¡Ã‚Â¬ÃƒÂ¢Ã¢â‚¬Å¾Ã‚Â¢ÃƒÆ’Ã†â€™Ãƒâ€ Ã¢â‚¬â„¢ÃƒÆ’Ã‚Â¢ÃƒÂ¢Ã¢â‚¬Å¡Ã‚Â¬Ãƒâ€šÃ‚Â ÃƒÆ’Ã†â€™Ãƒâ€šÃ‚Â¢ÃƒÆ’Ã‚Â¢ÃƒÂ¢Ã¢â€šÂ¬Ã…Â¡Ãƒâ€šÃ‚Â¬ÃƒÆ’Ã‚Â¢ÃƒÂ¢Ã¢â€šÂ¬Ã…Â¾Ãƒâ€šÃ‚Â¢ÃƒÆ’Ã†â€™Ãƒâ€ Ã¢â‚¬â„¢ÃƒÆ’Ã¢â‚¬Â ÃƒÂ¢Ã¢â€šÂ¬Ã¢â€žÂ¢ÃƒÆ’Ã†â€™Ãƒâ€šÃ‚Â¢ÃƒÆ’Ã‚Â¢ÃƒÂ¢Ã¢â€šÂ¬Ã…Â¡Ãƒâ€šÃ‚Â¬ÃƒÆ’Ã¢â‚¬Å¡Ãƒâ€šÃ‚Â ÃƒÆ’Ã†â€™Ãƒâ€ Ã¢â‚¬â„¢ÃƒÆ’Ã¢â‚¬Å¡Ãƒâ€šÃ‚Â¢ÃƒÆ’Ã†â€™Ãƒâ€šÃ‚Â¢ÃƒÆ’Ã‚Â¢ÃƒÂ¢Ã¢â‚¬Å¡Ã‚Â¬Ãƒâ€¦Ã‚Â¡ÃƒÆ’Ã¢â‚¬Å¡Ãƒâ€šÃ‚Â¬ÃƒÆ’Ã†â€™Ãƒâ€šÃ‚Â¢ÃƒÆ’Ã‚Â¢ÃƒÂ¢Ã¢â‚¬Å¡Ã‚Â¬Ãƒâ€¦Ã‚Â¾ÃƒÆ’Ã¢â‚¬Å¡Ãƒâ€šÃ‚Â¢ÃƒÆ’Ã†â€™Ãƒâ€ Ã¢â‚¬â„¢ÃƒÆ’Ã¢â‚¬Â ÃƒÂ¢Ã¢â€šÂ¬Ã¢â€žÂ¢ÃƒÆ’Ã†â€™ÃƒÂ¢Ã¢â€šÂ¬Ã‚Â ÃƒÆ’Ã‚Â¢ÃƒÂ¢Ã¢â‚¬Å¡Ã‚Â¬ÃƒÂ¢Ã¢â‚¬Å¾Ã‚Â¢ÃƒÆ’Ã†â€™Ãƒâ€ Ã¢â‚¬â„¢ÃƒÆ’Ã¢â‚¬Å¡Ãƒâ€šÃ‚Â¢ÃƒÆ’Ã†â€™Ãƒâ€šÃ‚Â¢ÃƒÆ’Ã‚Â¢ÃƒÂ¢Ã¢â‚¬Å¡Ã‚Â¬Ãƒâ€¦Ã‚Â¡ÃƒÆ’Ã¢â‚¬Å¡Ãƒâ€šÃ‚Â¬ÃƒÆ’Ã†â€™ÃƒÂ¢Ã¢â€šÂ¬Ã…Â¡ÃƒÆ’Ã¢â‚¬Å¡Ãƒâ€šÃ‚Â ÃƒÆ’Ã†â€™Ãƒâ€ Ã¢â‚¬â„¢ÃƒÆ’Ã¢â‚¬Â ÃƒÂ¢Ã¢â€šÂ¬Ã¢â€žÂ¢ÃƒÆ’Ã†â€™ÃƒÂ¢Ã¢â€šÂ¬Ã…Â¡ÃƒÆ’Ã¢â‚¬Å¡Ãƒâ€šÃ‚Â¢ÃƒÆ’Ã†â€™Ãƒâ€ Ã¢â‚¬â„¢ÃƒÆ’Ã¢â‚¬Å¡Ãƒâ€šÃ‚Â¢ÃƒÆ’Ã†â€™Ãƒâ€šÃ‚Â¢ÃƒÆ’Ã‚Â¢ÃƒÂ¢Ã¢â€šÂ¬Ã…Â¡Ãƒâ€šÃ‚Â¬ÃƒÆ’Ã¢â‚¬Â¦Ãƒâ€šÃ‚Â¡ÃƒÆ’Ã†â€™ÃƒÂ¢Ã¢â€šÂ¬Ã…Â¡ÃƒÆ’Ã¢â‚¬Å¡Ãƒâ€šÃ‚Â¬ÃƒÆ’Ã†â€™Ãƒâ€ Ã¢â‚¬â„¢ÃƒÆ’Ã¢â‚¬Å¡Ãƒâ€šÃ‚Â¢ÃƒÆ’Ã†â€™Ãƒâ€šÃ‚Â¢ÃƒÆ’Ã‚Â¢ÃƒÂ¢Ã¢â€šÂ¬Ã…Â¡Ãƒâ€šÃ‚Â¬ÃƒÆ’Ã¢â‚¬Â¦Ãƒâ€šÃ‚Â¾ÃƒÆ’Ã†â€™ÃƒÂ¢Ã¢â€šÂ¬Ã…Â¡ÃƒÆ’Ã¢â‚¬Å¡Ãƒâ€šÃ‚Â¢ÃƒÆ’Ã†â€™Ãƒâ€ Ã¢â‚¬â„¢ÃƒÆ’Ã¢â‚¬Â ÃƒÂ¢Ã¢â€šÂ¬Ã¢â€žÂ¢ÃƒÆ’Ã†â€™ÃƒÂ¢Ã¢â€šÂ¬Ã‚Â ÃƒÆ’Ã‚Â¢ÃƒÂ¢Ã¢â‚¬Å¡Ã‚Â¬ÃƒÂ¢Ã¢â‚¬Å¾Ã‚Â¢ÃƒÆ’Ã†â€™Ãƒâ€ Ã¢â‚¬â„¢ÃƒÆ’Ã‚Â¢ÃƒÂ¢Ã¢â‚¬Å¡Ã‚Â¬Ãƒâ€šÃ‚Â ÃƒÆ’Ã†â€™Ãƒâ€šÃ‚Â¢ÃƒÆ’Ã‚Â¢ÃƒÂ¢Ã¢â€šÂ¬Ã…Â¡Ãƒâ€šÃ‚Â¬ÃƒÆ’Ã‚Â¢ÃƒÂ¢Ã¢â€šÂ¬Ã…Â¾Ãƒâ€šÃ‚Â¢ÃƒÆ’Ã†â€™Ãƒâ€ Ã¢â‚¬â„¢ÃƒÆ’Ã¢â‚¬Â ÃƒÂ¢Ã¢â€šÂ¬Ã¢â€žÂ¢ÃƒÆ’Ã†â€™Ãƒâ€šÃ‚Â¢ÃƒÆ’Ã‚Â¢ÃƒÂ¢Ã¢â€šÂ¬Ã…Â¡Ãƒâ€šÃ‚Â¬ÃƒÆ’Ã¢â‚¬Â¦Ãƒâ€šÃ‚Â¡ÃƒÆ’Ã†â€™Ãƒâ€ Ã¢â‚¬â„¢ÃƒÆ’Ã‚Â¢ÃƒÂ¢Ã¢â‚¬Å¡Ã‚Â¬Ãƒâ€¦Ã‚Â¡ÃƒÆ’Ã†â€™ÃƒÂ¢Ã¢â€šÂ¬Ã…Â¡ÃƒÆ’Ã¢â‚¬Å¡Ãƒâ€šÃ‚Â¢ÃƒÆ’Ã†â€™Ãƒâ€ Ã¢â‚¬â„¢ÃƒÆ’Ã¢â‚¬Â ÃƒÂ¢Ã¢â€šÂ¬Ã¢â€žÂ¢ÃƒÆ’Ã†â€™ÃƒÂ¢Ã¢â€šÂ¬Ã‚Â ÃƒÆ’Ã‚Â¢ÃƒÂ¢Ã¢â‚¬Å¡Ã‚Â¬ÃƒÂ¢Ã¢â‚¬Å¾Ã‚Â¢ÃƒÆ’Ã†â€™Ãƒâ€ Ã¢â‚¬â„¢ÃƒÆ’Ã‚Â¢ÃƒÂ¢Ã¢â‚¬Å¡Ã‚Â¬Ãƒâ€¦Ã‚Â¡ÃƒÆ’Ã†â€™ÃƒÂ¢Ã¢â€šÂ¬Ã…Â¡ÃƒÆ’Ã¢â‚¬Å¡Ãƒâ€šÃ‚Â¢ÃƒÆ’Ã†â€™Ãƒâ€ Ã¢â‚¬â„¢ÃƒÆ’Ã¢â‚¬Â ÃƒÂ¢Ã¢â€šÂ¬Ã¢â€žÂ¢ÃƒÆ’Ã†â€™ÃƒÂ¢Ã¢â€šÂ¬Ã…Â¡ÃƒÆ’Ã¢â‚¬Å¡Ãƒâ€šÃ‚Â¢ÃƒÆ’Ã†â€™Ãƒâ€ Ã¢â‚¬â„¢ÃƒÆ’Ã¢â‚¬Å¡Ãƒâ€šÃ‚Â¢ÃƒÆ’Ã†â€™Ãƒâ€šÃ‚Â¢ÃƒÆ’Ã‚Â¢ÃƒÂ¢Ã¢â€šÂ¬Ã…Â¡Ãƒâ€šÃ‚Â¬ÃƒÆ’Ã¢â‚¬Â¦Ãƒâ€šÃ‚Â¡ÃƒÆ’Ã†â€™ÃƒÂ¢Ã¢â€šÂ¬Ã…Â¡ÃƒÆ’Ã¢â‚¬Å¡Ãƒâ€šÃ‚Â¬ÃƒÆ’Ã†â€™Ãƒâ€ Ã¢â‚¬â„¢ÃƒÆ’Ã‚Â¢ÃƒÂ¢Ã¢â‚¬Å¡Ã‚Â¬Ãƒâ€šÃ‚Â¦ÃƒÆ’Ã†â€™ÃƒÂ¢Ã¢â€šÂ¬Ã…Â¡ÃƒÆ’Ã¢â‚¬Å¡Ãƒâ€šÃ‚Â¡ÃƒÆ’Ã†â€™Ãƒâ€ Ã¢â‚¬â„¢ÃƒÆ’Ã¢â‚¬Â ÃƒÂ¢Ã¢â€šÂ¬Ã¢â€žÂ¢ÃƒÆ’Ã†â€™Ãƒâ€šÃ‚Â¢ÃƒÆ’Ã‚Â¢ÃƒÂ¢Ã¢â€šÂ¬Ã…Â¡Ãƒâ€šÃ‚Â¬ÃƒÆ’Ã¢â‚¬Â¦Ãƒâ€šÃ‚Â¡ÃƒÆ’Ã†â€™Ãƒâ€ Ã¢â‚¬â„¢ÃƒÆ’Ã‚Â¢ÃƒÂ¢Ã¢â‚¬Å¡Ã‚Â¬Ãƒâ€¦Ã‚Â¡ÃƒÆ’Ã†â€™ÃƒÂ¢Ã¢â€šÂ¬Ã…Â¡ÃƒÆ’Ã¢â‚¬Å¡Ãƒâ€šÃ‚Â¬ÃƒÆ’Ã†â€™Ãƒâ€ Ã¢â‚¬â„¢ÃƒÆ’Ã¢â‚¬Â ÃƒÂ¢Ã¢â€šÂ¬Ã¢â€žÂ¢ÃƒÆ’Ã†â€™ÃƒÂ¢Ã¢â€šÂ¬Ã‚Â ÃƒÆ’Ã‚Â¢ÃƒÂ¢Ã¢â‚¬Å¡Ã‚Â¬ÃƒÂ¢Ã¢â‚¬Å¾Ã‚Â¢ÃƒÆ’Ã†â€™Ãƒâ€ Ã¢â‚¬â„¢ÃƒÆ’Ã¢â‚¬Å¡Ãƒâ€šÃ‚Â¢ÃƒÆ’Ã†â€™Ãƒâ€šÃ‚Â¢ÃƒÆ’Ã‚Â¢ÃƒÂ¢Ã¢â‚¬Å¡Ã‚Â¬Ãƒâ€¦Ã‚Â¡ÃƒÆ’Ã¢â‚¬Å¡Ãƒâ€šÃ‚Â¬ÃƒÆ’Ã†â€™ÃƒÂ¢Ã¢â€šÂ¬Ã…Â¡ÃƒÆ’Ã¢â‚¬Å¡Ãƒâ€šÃ‚Â¦ÃƒÆ’Ã†â€™Ãƒâ€ Ã¢â‚¬â„¢ÃƒÆ’Ã¢â‚¬Â ÃƒÂ¢Ã¢â€šÂ¬Ã¢â€žÂ¢ÃƒÆ’Ã†â€™Ãƒâ€šÃ‚Â¢ÃƒÆ’Ã‚Â¢ÃƒÂ¢Ã¢â€šÂ¬Ã…Â¡Ãƒâ€šÃ‚Â¬ÃƒÆ’Ã¢â‚¬Â¦Ãƒâ€šÃ‚Â¡ÃƒÆ’Ã†â€™Ãƒâ€ Ã¢â‚¬â„¢ÃƒÆ’Ã‚Â¢ÃƒÂ¢Ã¢â‚¬Å¡Ã‚Â¬Ãƒâ€¦Ã‚Â¡ÃƒÆ’Ã†â€™ÃƒÂ¢Ã¢â€šÂ¬Ã…Â¡ÃƒÆ’Ã¢â‚¬Å¡Ãƒâ€šÃ‚Â¡ÃƒÆ’Ã†â€™Ãƒâ€ Ã¢â‚¬â„¢ÃƒÆ’Ã¢â‚¬Â ÃƒÂ¢Ã¢â€šÂ¬Ã¢â€žÂ¢ÃƒÆ’Ã†â€™ÃƒÂ¢Ã¢â€šÂ¬Ã‚Â ÃƒÆ’Ã‚Â¢ÃƒÂ¢Ã¢â‚¬Å¡Ã‚Â¬ÃƒÂ¢Ã¢â‚¬Å¾Ã‚Â¢ÃƒÆ’Ã†â€™Ãƒâ€ Ã¢â‚¬â„¢ÃƒÆ’Ã‚Â¢ÃƒÂ¢Ã¢â‚¬Å¡Ã‚Â¬Ãƒâ€šÃ‚Â ÃƒÆ’Ã†â€™Ãƒâ€šÃ‚Â¢ÃƒÆ’Ã‚Â¢ÃƒÂ¢Ã¢â€šÂ¬Ã…Â¡Ãƒâ€šÃ‚Â¬ÃƒÆ’Ã‚Â¢ÃƒÂ¢Ã¢â€šÂ¬Ã…Â¾Ãƒâ€šÃ‚Â¢ÃƒÆ’Ã†â€™Ãƒâ€ Ã¢â‚¬â„¢ÃƒÆ’Ã¢â‚¬Â ÃƒÂ¢Ã¢â€šÂ¬Ã¢â€žÂ¢ÃƒÆ’Ã†â€™Ãƒâ€šÃ‚Â¢ÃƒÆ’Ã‚Â¢ÃƒÂ¢Ã¢â€šÂ¬Ã…Â¡Ãƒâ€šÃ‚Â¬ÃƒÆ’Ã¢â‚¬Å¡Ãƒâ€šÃ‚Â ÃƒÆ’Ã†â€™Ãƒâ€ Ã¢â‚¬â„¢ÃƒÆ’Ã¢â‚¬Å¡Ãƒâ€šÃ‚Â¢ÃƒÆ’Ã†â€™Ãƒâ€šÃ‚Â¢ÃƒÆ’Ã‚Â¢ÃƒÂ¢Ã¢â‚¬Å¡Ã‚Â¬Ãƒâ€¦Ã‚Â¡ÃƒÆ’Ã¢â‚¬Å¡Ãƒâ€šÃ‚Â¬ÃƒÆ’Ã†â€™Ãƒâ€šÃ‚Â¢ÃƒÆ’Ã‚Â¢ÃƒÂ¢Ã¢â‚¬Å¡Ã‚Â¬Ãƒâ€¦Ã‚Â¾ÃƒÆ’Ã¢â‚¬Å¡Ãƒâ€šÃ‚Â¢ÃƒÆ’Ã†â€™Ãƒâ€ Ã¢â‚¬â„¢ÃƒÆ’Ã¢â‚¬Â ÃƒÂ¢Ã¢â€šÂ¬Ã¢â€žÂ¢ÃƒÆ’Ã†â€™ÃƒÂ¢Ã¢â€šÂ¬Ã‚Â ÃƒÆ’Ã‚Â¢ÃƒÂ¢Ã¢â‚¬Å¡Ã‚Â¬ÃƒÂ¢Ã¢â‚¬Å¾Ã‚Â¢ÃƒÆ’Ã†â€™Ãƒâ€ Ã¢â‚¬â„¢ÃƒÆ’Ã‚Â¢ÃƒÂ¢Ã¢â‚¬Å¡Ã‚Â¬Ãƒâ€¦Ã‚Â¡ÃƒÆ’Ã†â€™ÃƒÂ¢Ã¢â€šÂ¬Ã…Â¡ÃƒÆ’Ã¢â‚¬Å¡Ãƒâ€šÃ‚Â¢ÃƒÆ’Ã†â€™Ãƒâ€ Ã¢â‚¬â„¢ÃƒÆ’Ã¢â‚¬Â ÃƒÂ¢Ã¢â€šÂ¬Ã¢â€žÂ¢ÃƒÆ’Ã†â€™ÃƒÂ¢Ã¢â€šÂ¬Ã…Â¡ÃƒÆ’Ã¢â‚¬Å¡Ãƒâ€šÃ‚Â¢ÃƒÆ’Ã†â€™Ãƒâ€ Ã¢â‚¬â„¢ÃƒÆ’Ã¢â‚¬Å¡Ãƒâ€šÃ‚Â¢ÃƒÆ’Ã†â€™Ãƒâ€šÃ‚Â¢ÃƒÆ’Ã‚Â¢ÃƒÂ¢Ã¢â‚¬Å¡Ã‚Â¬Ãƒâ€¦Ã‚Â¡ÃƒÆ’Ã¢â‚¬Å¡Ãƒâ€šÃ‚Â¬ÃƒÆ’Ã†â€™ÃƒÂ¢Ã¢â€šÂ¬Ã‚Â¦ÃƒÆ’Ã¢â‚¬Å¡Ãƒâ€šÃ‚Â¡ÃƒÆ’Ã†â€™Ãƒâ€ Ã¢â‚¬â„¢ÃƒÆ’Ã‚Â¢ÃƒÂ¢Ã¢â‚¬Å¡Ã‚Â¬Ãƒâ€¦Ã‚Â¡ÃƒÆ’Ã†â€™ÃƒÂ¢Ã¢â€šÂ¬Ã…Â¡ÃƒÆ’Ã¢â‚¬Å¡Ãƒâ€šÃ‚Â¬ÃƒÆ’Ã†â€™Ãƒâ€ Ã¢â‚¬â„¢ÃƒÆ’Ã¢â‚¬Â ÃƒÂ¢Ã¢â€šÂ¬Ã¢â€žÂ¢ÃƒÆ’Ã†â€™Ãƒâ€šÃ‚Â¢ÃƒÆ’Ã‚Â¢ÃƒÂ¢Ã¢â€šÂ¬Ã…Â¡Ãƒâ€šÃ‚Â¬ÃƒÆ’Ã¢â‚¬Å¡Ãƒâ€šÃ‚Â¦ÃƒÆ’Ã†â€™Ãƒâ€ Ã¢â‚¬â„¢ÃƒÆ’Ã‚Â¢ÃƒÂ¢Ã¢â‚¬Å¡Ã‚Â¬Ãƒâ€¦Ã‚Â¡ÃƒÆ’Ã†â€™ÃƒÂ¢Ã¢â€šÂ¬Ã…Â¡ÃƒÆ’Ã¢â‚¬Å¡Ãƒâ€šÃ‚Â¡ÃƒÆ’Ã†â€™Ãƒâ€ Ã¢â‚¬â„¢ÃƒÆ’Ã¢â‚¬Â ÃƒÂ¢Ã¢â€šÂ¬Ã¢â€žÂ¢ÃƒÆ’Ã†â€™ÃƒÂ¢Ã¢â€šÂ¬Ã‚Â ÃƒÆ’Ã‚Â¢ÃƒÂ¢Ã¢â‚¬Å¡Ã‚Â¬ÃƒÂ¢Ã¢â‚¬Å¾Ã‚Â¢ÃƒÆ’Ã†â€™Ãƒâ€ Ã¢â‚¬â„¢ÃƒÆ’Ã‚Â¢ÃƒÂ¢Ã¢â‚¬Å¡Ã‚Â¬Ãƒâ€šÃ‚Â ÃƒÆ’Ã†â€™Ãƒâ€šÃ‚Â¢ÃƒÆ’Ã‚Â¢ÃƒÂ¢Ã¢â€šÂ¬Ã…Â¡Ãƒâ€šÃ‚Â¬ÃƒÆ’Ã‚Â¢ÃƒÂ¢Ã¢â€šÂ¬Ã…Â¾Ãƒâ€šÃ‚Â¢ÃƒÆ’Ã†â€™Ãƒâ€ Ã¢â‚¬â„¢ÃƒÆ’Ã¢â‚¬Â ÃƒÂ¢Ã¢â€šÂ¬Ã¢â€žÂ¢ÃƒÆ’Ã†â€™ÃƒÂ¢Ã¢â€šÂ¬Ã…Â¡ÃƒÆ’Ã¢â‚¬Å¡Ãƒâ€šÃ‚Â¢ÃƒÆ’Ã†â€™Ãƒâ€ Ã¢â‚¬â„¢ÃƒÆ’Ã¢â‚¬Å¡Ãƒâ€šÃ‚Â¢ÃƒÆ’Ã†â€™Ãƒâ€šÃ‚Â¢ÃƒÆ’Ã‚Â¢ÃƒÂ¢Ã¢â€šÂ¬Ã…Â¡Ãƒâ€šÃ‚Â¬ÃƒÆ’Ã¢â‚¬Â¦Ãƒâ€šÃ‚Â¡ÃƒÆ’Ã†â€™ÃƒÂ¢Ã¢â€šÂ¬Ã…Â¡ÃƒÆ’Ã¢â‚¬Å¡Ãƒâ€šÃ‚Â¬ÃƒÆ’Ã†â€™Ãƒâ€ Ã¢â‚¬â„¢ÃƒÆ’Ã‚Â¢ÃƒÂ¢Ã¢â‚¬Å¡Ã‚Â¬Ãƒâ€šÃ‚Â¦ÃƒÆ’Ã†â€™ÃƒÂ¢Ã¢â€šÂ¬Ã…Â¡ÃƒÆ’Ã¢â‚¬Å¡Ãƒâ€šÃ‚Â¡ÃƒÆ’Ã†â€™Ãƒâ€ Ã¢â‚¬â„¢ÃƒÆ’Ã¢â‚¬Â ÃƒÂ¢Ã¢â€šÂ¬Ã¢â€žÂ¢ÃƒÆ’Ã†â€™ÃƒÂ¢Ã¢â€šÂ¬Ã‚Â ÃƒÆ’Ã‚Â¢ÃƒÂ¢Ã¢â‚¬Å¡Ã‚Â¬ÃƒÂ¢Ã¢â‚¬Å¾Ã‚Â¢ÃƒÆ’Ã†â€™Ãƒâ€ Ã¢â‚¬â„¢ÃƒÆ’Ã¢â‚¬Å¡Ãƒâ€šÃ‚Â¢ÃƒÆ’Ã†â€™Ãƒâ€šÃ‚Â¢ÃƒÆ’Ã‚Â¢ÃƒÂ¢Ã¢â‚¬Å¡Ã‚Â¬Ãƒâ€¦Ã‚Â¡ÃƒÆ’Ã¢â‚¬Å¡Ãƒâ€šÃ‚Â¬ÃƒÆ’Ã†â€™ÃƒÂ¢Ã¢â€šÂ¬Ã‚Â¦ÃƒÆ’Ã¢â‚¬Å¡Ãƒâ€šÃ‚Â¡ÃƒÆ’Ã†â€™Ãƒâ€ Ã¢â‚¬â„¢ÃƒÆ’Ã¢â‚¬Â ÃƒÂ¢Ã¢â€šÂ¬Ã¢â€žÂ¢ÃƒÆ’Ã†â€™Ãƒâ€šÃ‚Â¢ÃƒÆ’Ã‚Â¢ÃƒÂ¢Ã¢â€šÂ¬Ã…Â¡Ãƒâ€šÃ‚Â¬ÃƒÆ’Ã¢â‚¬Â¦Ãƒâ€šÃ‚Â¡ÃƒÆ’Ã†â€™Ãƒâ€ Ã¢â‚¬â„¢ÃƒÆ’Ã‚Â¢ÃƒÂ¢Ã¢â‚¬Å¡Ã‚Â¬Ãƒâ€¦Ã‚Â¡ÃƒÆ’Ã†â€™ÃƒÂ¢Ã¢â€šÂ¬Ã…Â¡ÃƒÆ’Ã¢â‚¬Å¡Ãƒâ€šÃ‚Â°C). From Week 1 to Week 4, a clear declining trend was observed in both treatments, reaching the lowest temperatures at Week 4 (about 25.9ÃƒÆ’Ã†â€™Ãƒâ€ Ã¢â‚¬â„¢ÃƒÆ’Ã¢â‚¬Â ÃƒÂ¢Ã¢â€šÂ¬Ã¢â€žÂ¢ÃƒÆ’Ã†â€™ÃƒÂ¢Ã¢â€šÂ¬Ã‚Â ÃƒÆ’Ã‚Â¢ÃƒÂ¢Ã¢â‚¬Å¡Ã‚Â¬ÃƒÂ¢Ã¢â‚¬Å¾Ã‚Â¢ÃƒÆ’Ã†â€™Ãƒâ€ Ã¢â‚¬â„¢ÃƒÆ’Ã‚Â¢ÃƒÂ¢Ã¢â‚¬Å¡Ã‚Â¬Ãƒâ€šÃ‚Â ÃƒÆ’Ã†â€™Ãƒâ€šÃ‚Â¢ÃƒÆ’Ã‚Â¢ÃƒÂ¢Ã¢â€šÂ¬Ã…Â¡Ãƒâ€šÃ‚Â¬ÃƒÆ’Ã‚Â¢ÃƒÂ¢Ã¢â€šÂ¬Ã…Â¾Ãƒâ€šÃ‚Â¢ÃƒÆ’Ã†â€™Ãƒâ€ Ã¢â‚¬â„¢ÃƒÆ’Ã¢â‚¬Â ÃƒÂ¢Ã¢â€šÂ¬Ã¢â€žÂ¢ÃƒÆ’Ã†â€™Ãƒâ€šÃ‚Â¢ÃƒÆ’Ã‚Â¢ÃƒÂ¢Ã¢â€šÂ¬Ã…Â¡Ãƒâ€šÃ‚Â¬ÃƒÆ’Ã¢â‚¬Å¡Ãƒâ€šÃ‚Â ÃƒÆ’Ã†â€™Ãƒâ€ Ã¢â‚¬â„¢ÃƒÆ’Ã¢â‚¬Å¡Ãƒâ€šÃ‚Â¢ÃƒÆ’Ã†â€™Ãƒâ€šÃ‚Â¢ÃƒÆ’Ã‚Â¢ÃƒÂ¢Ã¢â‚¬Å¡Ã‚Â¬Ãƒâ€¦Ã‚Â¡ÃƒÆ’Ã¢â‚¬Å¡Ãƒâ€šÃ‚Â¬ÃƒÆ’Ã†â€™Ãƒâ€šÃ‚Â¢ÃƒÆ’Ã‚Â¢ÃƒÂ¢Ã¢â‚¬Å¡Ã‚Â¬Ãƒâ€¦Ã‚Â¾ÃƒÆ’Ã¢â‚¬Å¡Ãƒâ€šÃ‚Â¢ÃƒÆ’Ã†â€™Ãƒâ€ Ã¢â‚¬â„¢ÃƒÆ’Ã¢â‚¬Â ÃƒÂ¢Ã¢â€šÂ¬Ã¢â€žÂ¢ÃƒÆ’Ã†â€™ÃƒÂ¢Ã¢â€šÂ¬Ã‚Â ÃƒÆ’Ã‚Â¢ÃƒÂ¢Ã¢â‚¬Å¡Ã‚Â¬ÃƒÂ¢Ã¢â‚¬Å¾Ã‚Â¢ÃƒÆ’Ã†â€™Ãƒâ€ Ã¢â‚¬â„¢ÃƒÆ’Ã¢â‚¬Å¡Ãƒâ€šÃ‚Â¢ÃƒÆ’Ã†â€™Ãƒâ€šÃ‚Â¢ÃƒÆ’Ã‚Â¢ÃƒÂ¢Ã¢â‚¬Å¡Ã‚Â¬Ãƒâ€¦Ã‚Â¡ÃƒÆ’Ã¢â‚¬Å¡Ãƒâ€šÃ‚Â¬ÃƒÆ’Ã†â€™ÃƒÂ¢Ã¢â€šÂ¬Ã…Â¡ÃƒÆ’Ã¢â‚¬Å¡Ãƒâ€šÃ‚Â ÃƒÆ’Ã†â€™Ãƒâ€ Ã¢â‚¬â„¢ÃƒÆ’Ã¢â‚¬Â ÃƒÂ¢Ã¢â€šÂ¬Ã¢â€žÂ¢ÃƒÆ’Ã†â€™ÃƒÂ¢Ã¢â€šÂ¬Ã…Â¡ÃƒÆ’Ã¢â‚¬Å¡Ãƒâ€šÃ‚Â¢ÃƒÆ’Ã†â€™Ãƒâ€ Ã¢â‚¬â„¢ÃƒÆ’Ã¢â‚¬Å¡Ãƒâ€šÃ‚Â¢ÃƒÆ’Ã†â€™Ãƒâ€šÃ‚Â¢ÃƒÆ’Ã‚Â¢ÃƒÂ¢Ã¢â€šÂ¬Ã…Â¡Ãƒâ€šÃ‚Â¬ÃƒÆ’Ã¢â‚¬Â¦Ãƒâ€šÃ‚Â¡ÃƒÆ’Ã†â€™ÃƒÂ¢Ã¢â€šÂ¬Ã…Â¡ÃƒÆ’Ã¢â‚¬Å¡Ãƒâ€šÃ‚Â¬ÃƒÆ’Ã†â€™Ãƒâ€ Ã¢â‚¬â„¢ÃƒÆ’Ã¢â‚¬Å¡Ãƒâ€šÃ‚Â¢ÃƒÆ’Ã†â€™Ãƒâ€šÃ‚Â¢ÃƒÆ’Ã‚Â¢ÃƒÂ¢Ã¢â€šÂ¬Ã…Â¡Ãƒâ€šÃ‚Â¬ÃƒÆ’Ã¢â‚¬Â¦Ãƒâ€šÃ‚Â¾ÃƒÆ’Ã†â€™ÃƒÂ¢Ã¢â€šÂ¬Ã…Â¡ÃƒÆ’Ã¢â‚¬Å¡Ãƒâ€šÃ‚Â¢ÃƒÆ’Ã†â€™Ãƒâ€ Ã¢â‚¬â„¢ÃƒÆ’Ã¢â‚¬Â ÃƒÂ¢Ã¢â€šÂ¬Ã¢â€žÂ¢ÃƒÆ’Ã†â€™ÃƒÂ¢Ã¢â€šÂ¬Ã‚Â ÃƒÆ’Ã‚Â¢ÃƒÂ¢Ã¢â‚¬Å¡Ã‚Â¬ÃƒÂ¢Ã¢â‚¬Å¾Ã‚Â¢ÃƒÆ’Ã†â€™Ãƒâ€ Ã¢â‚¬â„¢ÃƒÆ’Ã‚Â¢ÃƒÂ¢Ã¢â‚¬Å¡Ã‚Â¬Ãƒâ€šÃ‚Â ÃƒÆ’Ã†â€™Ãƒâ€šÃ‚Â¢ÃƒÆ’Ã‚Â¢ÃƒÂ¢Ã¢â€šÂ¬Ã…Â¡Ãƒâ€šÃ‚Â¬ÃƒÆ’Ã‚Â¢ÃƒÂ¢Ã¢â€šÂ¬Ã…Â¾Ãƒâ€šÃ‚Â¢ÃƒÆ’Ã†â€™Ãƒâ€ Ã¢â‚¬â„¢ÃƒÆ’Ã¢â‚¬Â ÃƒÂ¢Ã¢â€šÂ¬Ã¢â€žÂ¢ÃƒÆ’Ã†â€™Ãƒâ€šÃ‚Â¢ÃƒÆ’Ã‚Â¢ÃƒÂ¢Ã¢â€šÂ¬Ã…Â¡Ãƒâ€šÃ‚Â¬ÃƒÆ’Ã¢â‚¬Â¦Ãƒâ€šÃ‚Â¡ÃƒÆ’Ã†â€™Ãƒâ€ Ã¢â‚¬â„¢ÃƒÆ’Ã‚Â¢ÃƒÂ¢Ã¢â‚¬Å¡Ã‚Â¬Ãƒâ€¦Ã‚Â¡ÃƒÆ’Ã†â€™ÃƒÂ¢Ã¢â€šÂ¬Ã…Â¡ÃƒÆ’Ã¢â‚¬Å¡Ãƒâ€šÃ‚Â¢ÃƒÆ’Ã†â€™Ãƒâ€ Ã¢â‚¬â„¢ÃƒÆ’Ã¢â‚¬Â ÃƒÂ¢Ã¢â€šÂ¬Ã¢â€žÂ¢ÃƒÆ’Ã†â€™ÃƒÂ¢Ã¢â€šÂ¬Ã‚Â ÃƒÆ’Ã‚Â¢ÃƒÂ¢Ã¢â‚¬Å¡Ã‚Â¬ÃƒÂ¢Ã¢â‚¬Å¾Ã‚Â¢ÃƒÆ’Ã†â€™Ãƒâ€ Ã¢â‚¬â„¢ÃƒÆ’Ã‚Â¢ÃƒÂ¢Ã¢â‚¬Å¡Ã‚Â¬Ãƒâ€¦Ã‚Â¡ÃƒÆ’Ã†â€™ÃƒÂ¢Ã¢â€šÂ¬Ã…Â¡ÃƒÆ’Ã¢â‚¬Å¡Ãƒâ€šÃ‚Â¢ÃƒÆ’Ã†â€™Ãƒâ€ Ã¢â‚¬â„¢ÃƒÆ’Ã¢â‚¬Â ÃƒÂ¢Ã¢â€šÂ¬Ã¢â€žÂ¢ÃƒÆ’Ã†â€™ÃƒÂ¢Ã¢â€šÂ¬Ã…Â¡ÃƒÆ’Ã¢â‚¬Å¡Ãƒâ€šÃ‚Â¢ÃƒÆ’Ã†â€™Ãƒâ€ Ã¢â‚¬â„¢ÃƒÆ’Ã¢â‚¬Å¡Ãƒâ€šÃ‚Â¢ÃƒÆ’Ã†â€™Ãƒâ€šÃ‚Â¢ÃƒÆ’Ã‚Â¢ÃƒÂ¢Ã¢â€šÂ¬Ã…Â¡Ãƒâ€šÃ‚Â¬ÃƒÆ’Ã¢â‚¬Â¦Ãƒâ€šÃ‚Â¡ÃƒÆ’Ã†â€™ÃƒÂ¢Ã¢â€šÂ¬Ã…Â¡ÃƒÆ’Ã¢â‚¬Å¡Ãƒâ€šÃ‚Â¬ÃƒÆ’Ã†â€™Ãƒâ€ Ã¢â‚¬â„¢ÃƒÆ’Ã‚Â¢ÃƒÂ¢Ã¢â‚¬Å¡Ã‚Â¬Ãƒâ€šÃ‚Â¦ÃƒÆ’Ã†â€™ÃƒÂ¢Ã¢â€šÂ¬Ã…Â¡ÃƒÆ’Ã¢â‚¬Å¡Ãƒâ€šÃ‚Â¡ÃƒÆ’Ã†â€™Ãƒâ€ Ã¢â‚¬â„¢ÃƒÆ’Ã¢â‚¬Â ÃƒÂ¢Ã¢â€šÂ¬Ã¢â€žÂ¢ÃƒÆ’Ã†â€™Ãƒâ€šÃ‚Â¢ÃƒÆ’Ã‚Â¢ÃƒÂ¢Ã¢â€šÂ¬Ã…Â¡Ãƒâ€šÃ‚Â¬ÃƒÆ’Ã¢â‚¬Â¦Ãƒâ€šÃ‚Â¡ÃƒÆ’Ã†â€™Ãƒâ€ Ã¢â‚¬â„¢ÃƒÆ’Ã‚Â¢ÃƒÂ¢Ã¢â‚¬Å¡Ã‚Â¬Ãƒâ€¦Ã‚Â¡ÃƒÆ’Ã†â€™ÃƒÂ¢Ã¢â€šÂ¬Ã…Â¡ÃƒÆ’Ã¢â‚¬Å¡Ãƒâ€šÃ‚Â¬ÃƒÆ’Ã†â€™Ãƒâ€ Ã¢â‚¬â„¢ÃƒÆ’Ã¢â‚¬Â ÃƒÂ¢Ã¢â€šÂ¬Ã¢â€žÂ¢ÃƒÆ’Ã†â€™ÃƒÂ¢Ã¢â€šÂ¬Ã‚Â ÃƒÆ’Ã‚Â¢ÃƒÂ¢Ã¢â‚¬Å¡Ã‚Â¬ÃƒÂ¢Ã¢â‚¬Å¾Ã‚Â¢ÃƒÆ’Ã†â€™Ãƒâ€ Ã¢â‚¬â„¢ÃƒÆ’Ã¢â‚¬Å¡Ãƒâ€šÃ‚Â¢ÃƒÆ’Ã†â€™Ãƒâ€šÃ‚Â¢ÃƒÆ’Ã‚Â¢ÃƒÂ¢Ã¢â‚¬Å¡Ã‚Â¬Ãƒâ€¦Ã‚Â¡ÃƒÆ’Ã¢â‚¬Å¡Ãƒâ€šÃ‚Â¬ÃƒÆ’Ã†â€™ÃƒÂ¢Ã¢â€šÂ¬Ã…Â¡ÃƒÆ’Ã¢â‚¬Å¡Ãƒâ€šÃ‚Â¦ÃƒÆ’Ã†â€™Ãƒâ€ Ã¢â‚¬â„¢ÃƒÆ’Ã¢â‚¬Â ÃƒÂ¢Ã¢â€šÂ¬Ã¢â€žÂ¢ÃƒÆ’Ã†â€™Ãƒâ€šÃ‚Â¢ÃƒÆ’Ã‚Â¢ÃƒÂ¢Ã¢â€šÂ¬Ã…Â¡Ãƒâ€šÃ‚Â¬ÃƒÆ’Ã¢â‚¬Â¦Ãƒâ€šÃ‚Â¡ÃƒÆ’Ã†â€™Ãƒâ€ Ã¢â‚¬â„¢ÃƒÆ’Ã‚Â¢ÃƒÂ¢Ã¢â‚¬Å¡Ã‚Â¬Ãƒâ€¦Ã‚Â¡ÃƒÆ’Ã†â€™ÃƒÂ¢Ã¢â€šÂ¬Ã…Â¡ÃƒÆ’Ã¢â‚¬Å¡Ãƒâ€šÃ‚Â¡ÃƒÆ’Ã†â€™Ãƒâ€ Ã¢â‚¬â„¢ÃƒÆ’Ã¢â‚¬Â ÃƒÂ¢Ã¢â€šÂ¬Ã¢â€žÂ¢ÃƒÆ’Ã†â€™ÃƒÂ¢Ã¢â€šÂ¬Ã‚Â ÃƒÆ’Ã‚Â¢ÃƒÂ¢Ã¢â‚¬Å¡Ã‚Â¬ÃƒÂ¢Ã¢â‚¬Å¾Ã‚Â¢ÃƒÆ’Ã†â€™Ãƒâ€ Ã¢â‚¬â„¢ÃƒÆ’Ã‚Â¢ÃƒÂ¢Ã¢â‚¬Å¡Ã‚Â¬Ãƒâ€šÃ‚Â ÃƒÆ’Ã†â€™Ãƒâ€šÃ‚Â¢ÃƒÆ’Ã‚Â¢ÃƒÂ¢Ã¢â€šÂ¬Ã…Â¡Ãƒâ€šÃ‚Â¬ÃƒÆ’Ã‚Â¢ÃƒÂ¢Ã¢â€šÂ¬Ã…Â¾Ãƒâ€šÃ‚Â¢ÃƒÆ’Ã†â€™Ãƒâ€ Ã¢â‚¬â„¢ÃƒÆ’Ã¢â‚¬Â ÃƒÂ¢Ã¢â€šÂ¬Ã¢â€žÂ¢ÃƒÆ’Ã†â€™Ãƒâ€šÃ‚Â¢ÃƒÆ’Ã‚Â¢ÃƒÂ¢Ã¢â€šÂ¬Ã…Â¡Ãƒâ€šÃ‚Â¬ÃƒÆ’Ã¢â‚¬Å¡Ãƒâ€šÃ‚Â ÃƒÆ’Ã†â€™Ãƒâ€ Ã¢â‚¬â„¢ÃƒÆ’Ã¢â‚¬Å¡Ãƒâ€šÃ‚Â¢ÃƒÆ’Ã†â€™Ãƒâ€šÃ‚Â¢ÃƒÆ’Ã‚Â¢ÃƒÂ¢Ã¢â‚¬Å¡Ã‚Â¬Ãƒâ€¦Ã‚Â¡ÃƒÆ’Ã¢â‚¬Å¡Ãƒâ€šÃ‚Â¬ÃƒÆ’Ã†â€™Ãƒâ€šÃ‚Â¢ÃƒÆ’Ã‚Â¢ÃƒÂ¢Ã¢â‚¬Å¡Ã‚Â¬Ãƒâ€¦Ã‚Â¾ÃƒÆ’Ã¢â‚¬Å¡Ãƒâ€šÃ‚Â¢ÃƒÆ’Ã†â€™Ãƒâ€ Ã¢â‚¬â„¢ÃƒÆ’Ã¢â‚¬Â ÃƒÂ¢Ã¢â€šÂ¬Ã¢â€žÂ¢ÃƒÆ’Ã†â€™ÃƒÂ¢Ã¢â€šÂ¬Ã‚Â ÃƒÆ’Ã‚Â¢ÃƒÂ¢Ã¢â‚¬Å¡Ã‚Â¬ÃƒÂ¢Ã¢â‚¬Å¾Ã‚Â¢ÃƒÆ’Ã†â€™Ãƒâ€ Ã¢â‚¬â„¢ÃƒÆ’Ã‚Â¢ÃƒÂ¢Ã¢â‚¬Å¡Ã‚Â¬Ãƒâ€¦Ã‚Â¡ÃƒÆ’Ã†â€™ÃƒÂ¢Ã¢â€šÂ¬Ã…Â¡ÃƒÆ’Ã¢â‚¬Å¡Ãƒâ€šÃ‚Â¢ÃƒÆ’Ã†â€™Ãƒâ€ Ã¢â‚¬â„¢ÃƒÆ’Ã¢â‚¬Â ÃƒÂ¢Ã¢â€šÂ¬Ã¢â€žÂ¢ÃƒÆ’Ã†â€™ÃƒÂ¢Ã¢â€šÂ¬Ã…Â¡ÃƒÆ’Ã¢â‚¬Å¡Ãƒâ€šÃ‚Â¢ÃƒÆ’Ã†â€™Ãƒâ€ Ã¢â‚¬â„¢ÃƒÆ’Ã¢â‚¬Å¡Ãƒâ€šÃ‚Â¢ÃƒÆ’Ã†â€™Ãƒâ€šÃ‚Â¢ÃƒÆ’Ã‚Â¢ÃƒÂ¢Ã¢â‚¬Å¡Ã‚Â¬Ãƒâ€¦Ã‚Â¡ÃƒÆ’Ã¢â‚¬Å¡Ãƒâ€šÃ‚Â¬ÃƒÆ’Ã†â€™ÃƒÂ¢Ã¢â€šÂ¬Ã‚Â¦ÃƒÆ’Ã¢â‚¬Å¡Ãƒâ€šÃ‚Â¡ÃƒÆ’Ã†â€™Ãƒâ€ Ã¢â‚¬â„¢ÃƒÆ’Ã‚Â¢ÃƒÂ¢Ã¢â‚¬Å¡Ã‚Â¬Ãƒâ€¦Ã‚Â¡ÃƒÆ’Ã†â€™ÃƒÂ¢Ã¢â€šÂ¬Ã…Â¡ÃƒÆ’Ã¢â‚¬Å¡Ãƒâ€šÃ‚Â¬ÃƒÆ’Ã†â€™Ãƒâ€ Ã¢â‚¬â„¢ÃƒÆ’Ã¢â‚¬Â ÃƒÂ¢Ã¢â€šÂ¬Ã¢â€žÂ¢ÃƒÆ’Ã†â€™Ãƒâ€šÃ‚Â¢ÃƒÆ’Ã‚Â¢ÃƒÂ¢Ã¢â€šÂ¬Ã…Â¡Ãƒâ€šÃ‚Â¬ÃƒÆ’Ã¢â‚¬Å¡Ãƒâ€šÃ‚Â¦ÃƒÆ’Ã†â€™Ãƒâ€ Ã¢â‚¬â„¢ÃƒÆ’Ã‚Â¢ÃƒÂ¢Ã¢â‚¬Å¡Ã‚Â¬Ãƒâ€¦Ã‚Â¡ÃƒÆ’Ã†â€™ÃƒÂ¢Ã¢â€šÂ¬Ã…Â¡ÃƒÆ’Ã¢â‚¬Å¡Ãƒâ€šÃ‚Â¡ÃƒÆ’Ã†â€™Ãƒâ€ Ã¢â‚¬â„¢ÃƒÆ’Ã¢â‚¬Â ÃƒÂ¢Ã¢â€šÂ¬Ã¢â€žÂ¢ÃƒÆ’Ã†â€™ÃƒÂ¢Ã¢â€šÂ¬Ã‚Â ÃƒÆ’Ã‚Â¢ÃƒÂ¢Ã¢â‚¬Å¡Ã‚Â¬ÃƒÂ¢Ã¢â‚¬Å¾Ã‚Â¢ÃƒÆ’Ã†â€™Ãƒâ€ Ã¢â‚¬â„¢ÃƒÆ’Ã‚Â¢ÃƒÂ¢Ã¢â‚¬Å¡Ã‚Â¬Ãƒâ€šÃ‚Â ÃƒÆ’Ã†â€™Ãƒâ€šÃ‚Â¢ÃƒÆ’Ã‚Â¢ÃƒÂ¢Ã¢â€šÂ¬Ã…Â¡Ãƒâ€šÃ‚Â¬ÃƒÆ’Ã‚Â¢ÃƒÂ¢Ã¢â€šÂ¬Ã…Â¾Ãƒâ€šÃ‚Â¢ÃƒÆ’Ã†â€™Ãƒâ€ Ã¢â‚¬â„¢ÃƒÆ’Ã¢â‚¬Â ÃƒÂ¢Ã¢â€šÂ¬Ã¢â€žÂ¢ÃƒÆ’Ã†â€™ÃƒÂ¢Ã¢â€šÂ¬Ã…Â¡ÃƒÆ’Ã¢â‚¬Å¡Ãƒâ€šÃ‚Â¢ÃƒÆ’Ã†â€™Ãƒâ€ Ã¢â‚¬â„¢ÃƒÆ’Ã¢â‚¬Å¡Ãƒâ€šÃ‚Â¢ÃƒÆ’Ã†â€™Ãƒâ€šÃ‚Â¢ÃƒÆ’Ã‚Â¢ÃƒÂ¢Ã¢â€šÂ¬Ã…Â¡Ãƒâ€šÃ‚Â¬ÃƒÆ’Ã¢â‚¬Â¦Ãƒâ€šÃ‚Â¡ÃƒÆ’Ã†â€™ÃƒÂ¢Ã¢â€šÂ¬Ã…Â¡ÃƒÆ’Ã¢â‚¬Å¡Ãƒâ€šÃ‚Â¬ÃƒÆ’Ã†â€™Ãƒâ€ Ã¢â‚¬â„¢ÃƒÆ’Ã‚Â¢ÃƒÂ¢Ã¢â‚¬Å¡Ã‚Â¬Ãƒâ€šÃ‚Â¦ÃƒÆ’Ã†â€™ÃƒÂ¢Ã¢â€šÂ¬Ã…Â¡ÃƒÆ’Ã¢â‚¬Å¡Ãƒâ€šÃ‚Â¡ÃƒÆ’Ã†â€™Ãƒâ€ Ã¢â‚¬â„¢ÃƒÆ’Ã¢â‚¬Â ÃƒÂ¢Ã¢â€šÂ¬Ã¢â€žÂ¢ÃƒÆ’Ã†â€™ÃƒÂ¢Ã¢â€šÂ¬Ã‚Â ÃƒÆ’Ã‚Â¢ÃƒÂ¢Ã¢â‚¬Å¡Ã‚Â¬ÃƒÂ¢Ã¢â‚¬Å¾Ã‚Â¢ÃƒÆ’Ã†â€™Ãƒâ€ Ã¢â‚¬â„¢ÃƒÆ’Ã¢â‚¬Å¡Ãƒâ€šÃ‚Â¢ÃƒÆ’Ã†â€™Ãƒâ€šÃ‚Â¢ÃƒÆ’Ã‚Â¢ÃƒÂ¢Ã¢â‚¬Å¡Ã‚Â¬Ãƒâ€¦Ã‚Â¡ÃƒÆ’Ã¢â‚¬Å¡Ãƒâ€šÃ‚Â¬ÃƒÆ’Ã†â€™ÃƒÂ¢Ã¢â€šÂ¬Ã‚Â¦ÃƒÆ’Ã¢â‚¬Å¡Ãƒâ€šÃ‚Â¡ÃƒÆ’Ã†â€™Ãƒâ€ Ã¢â‚¬â„¢ÃƒÆ’Ã¢â‚¬Â ÃƒÂ¢Ã¢â€šÂ¬Ã¢â€žÂ¢ÃƒÆ’Ã†â€™Ãƒâ€šÃ‚Â¢ÃƒÆ’Ã‚Â¢ÃƒÂ¢Ã¢â€šÂ¬Ã…Â¡Ãƒâ€šÃ‚Â¬ÃƒÆ’Ã¢â‚¬Â¦Ãƒâ€šÃ‚Â¡ÃƒÆ’Ã†â€™Ãƒâ€ Ã¢â‚¬â„¢ÃƒÆ’Ã‚Â¢ÃƒÂ¢Ã¢â‚¬Å¡Ã‚Â¬Ãƒâ€¦Ã‚Â¡ÃƒÆ’Ã†â€™ÃƒÂ¢Ã¢â€šÂ¬Ã…Â¡ÃƒÆ’Ã¢â‚¬Å¡Ãƒâ€šÃ‚Â°C in Monoculture and 25.7ÃƒÆ’Ã†â€™Ãƒâ€ Ã¢â‚¬â„¢ÃƒÆ’Ã¢â‚¬Â ÃƒÂ¢Ã¢â€šÂ¬Ã¢â€žÂ¢ÃƒÆ’Ã†â€™ÃƒÂ¢Ã¢â€šÂ¬Ã‚Â ÃƒÆ’Ã‚Â¢ÃƒÂ¢Ã¢â‚¬Å¡Ã‚Â¬ÃƒÂ¢Ã¢â‚¬Å¾Ã‚Â¢ÃƒÆ’Ã†â€™Ãƒâ€ Ã¢â‚¬â„¢ÃƒÆ’Ã‚Â¢ÃƒÂ¢Ã¢â‚¬Å¡Ã‚Â¬Ãƒâ€šÃ‚Â ÃƒÆ’Ã†â€™Ãƒâ€šÃ‚Â¢ÃƒÆ’Ã‚Â¢ÃƒÂ¢Ã¢â€šÂ¬Ã…Â¡Ãƒâ€šÃ‚Â¬ÃƒÆ’Ã‚Â¢ÃƒÂ¢Ã¢â€šÂ¬Ã…Â¾Ãƒâ€šÃ‚Â¢ÃƒÆ’Ã†â€™Ãƒâ€ Ã¢â‚¬â„¢ÃƒÆ’Ã¢â‚¬Â ÃƒÂ¢Ã¢â€šÂ¬Ã¢â€žÂ¢ÃƒÆ’Ã†â€™Ãƒâ€šÃ‚Â¢ÃƒÆ’Ã‚Â¢ÃƒÂ¢Ã¢â€šÂ¬Ã…Â¡Ãƒâ€šÃ‚Â¬ÃƒÆ’Ã¢â‚¬Å¡Ãƒâ€šÃ‚Â ÃƒÆ’Ã†â€™Ãƒâ€ Ã¢â‚¬â„¢ÃƒÆ’Ã¢â‚¬Å¡Ãƒâ€šÃ‚Â¢ÃƒÆ’Ã†â€™Ãƒâ€šÃ‚Â¢ÃƒÆ’Ã‚Â¢ÃƒÂ¢Ã¢â‚¬Å¡Ã‚Â¬Ãƒâ€¦Ã‚Â¡ÃƒÆ’Ã¢â‚¬Å¡Ãƒâ€šÃ‚Â¬ÃƒÆ’Ã†â€™Ãƒâ€šÃ‚Â¢ÃƒÆ’Ã‚Â¢ÃƒÂ¢Ã¢â‚¬Å¡Ã‚Â¬Ãƒâ€¦Ã‚Â¾ÃƒÆ’Ã¢â‚¬Å¡Ãƒâ€šÃ‚Â¢ÃƒÆ’Ã†â€™Ãƒâ€ Ã¢â‚¬â„¢ÃƒÆ’Ã¢â‚¬Â ÃƒÂ¢Ã¢â€šÂ¬Ã¢â€žÂ¢ÃƒÆ’Ã†â€™ÃƒÂ¢Ã¢â€šÂ¬Ã‚Â ÃƒÆ’Ã‚Â¢ÃƒÂ¢Ã¢â‚¬Å¡Ã‚Â¬ÃƒÂ¢Ã¢â‚¬Å¾Ã‚Â¢ÃƒÆ’Ã†â€™Ãƒâ€ Ã¢â‚¬â„¢ÃƒÆ’Ã¢â‚¬Å¡Ãƒâ€šÃ‚Â¢ÃƒÆ’Ã†â€™Ãƒâ€šÃ‚Â¢ÃƒÆ’Ã‚Â¢ÃƒÂ¢Ã¢â‚¬Å¡Ã‚Â¬Ãƒâ€¦Ã‚Â¡ÃƒÆ’Ã¢â‚¬Å¡Ãƒâ€šÃ‚Â¬ÃƒÆ’Ã†â€™ÃƒÂ¢Ã¢â€šÂ¬Ã…Â¡ÃƒÆ’Ã¢â‚¬Å¡Ãƒâ€šÃ‚Â ÃƒÆ’Ã†â€™Ãƒâ€ Ã¢â‚¬â„¢ÃƒÆ’Ã¢â‚¬Â ÃƒÂ¢Ã¢â€šÂ¬Ã¢â€žÂ¢ÃƒÆ’Ã†â€™ÃƒÂ¢Ã¢â€šÂ¬Ã…Â¡ÃƒÆ’Ã¢â‚¬Å¡Ãƒâ€šÃ‚Â¢ÃƒÆ’Ã†â€™Ãƒâ€ Ã¢â‚¬â„¢ÃƒÆ’Ã¢â‚¬Å¡Ãƒâ€šÃ‚Â¢ÃƒÆ’Ã†â€™Ãƒâ€šÃ‚Â¢ÃƒÆ’Ã‚Â¢ÃƒÂ¢Ã¢â€šÂ¬Ã…Â¡Ãƒâ€šÃ‚Â¬ÃƒÆ’Ã¢â‚¬Â¦Ãƒâ€šÃ‚Â¡ÃƒÆ’Ã†â€™ÃƒÂ¢Ã¢â€šÂ¬Ã…Â¡ÃƒÆ’Ã¢â‚¬Å¡Ãƒâ€šÃ‚Â¬ÃƒÆ’Ã†â€™Ãƒâ€ Ã¢â‚¬â„¢ÃƒÆ’Ã¢â‚¬Å¡Ãƒâ€šÃ‚Â¢ÃƒÆ’Ã†â€™Ãƒâ€šÃ‚Â¢ÃƒÆ’Ã‚Â¢ÃƒÂ¢Ã¢â€šÂ¬Ã…Â¡Ãƒâ€šÃ‚Â¬ÃƒÆ’Ã¢â‚¬Â¦Ãƒâ€šÃ‚Â¾ÃƒÆ’Ã†â€™ÃƒÂ¢Ã¢â€šÂ¬Ã…Â¡ÃƒÆ’Ã¢â‚¬Å¡Ãƒâ€šÃ‚Â¢ÃƒÆ’Ã†â€™Ãƒâ€ Ã¢â‚¬â„¢ÃƒÆ’Ã¢â‚¬Â ÃƒÂ¢Ã¢â€šÂ¬Ã¢â€žÂ¢ÃƒÆ’Ã†â€™ÃƒÂ¢Ã¢â€šÂ¬Ã‚Â ÃƒÆ’Ã‚Â¢ÃƒÂ¢Ã¢â‚¬Å¡Ã‚Â¬ÃƒÂ¢Ã¢â‚¬Å¾Ã‚Â¢ÃƒÆ’Ã†â€™Ãƒâ€ Ã¢â‚¬â„¢ÃƒÆ’Ã‚Â¢ÃƒÂ¢Ã¢â‚¬Å¡Ã‚Â¬Ãƒâ€šÃ‚Â ÃƒÆ’Ã†â€™Ãƒâ€šÃ‚Â¢ÃƒÆ’Ã‚Â¢ÃƒÂ¢Ã¢â€šÂ¬Ã…Â¡Ãƒâ€šÃ‚Â¬ÃƒÆ’Ã‚Â¢ÃƒÂ¢Ã¢â€šÂ¬Ã…Â¾Ãƒâ€šÃ‚Â¢ÃƒÆ’Ã†â€™Ãƒâ€ Ã¢â‚¬â„¢ÃƒÆ’Ã¢â‚¬Â ÃƒÂ¢Ã¢â€šÂ¬Ã¢â€žÂ¢ÃƒÆ’Ã†â€™Ãƒâ€šÃ‚Â¢ÃƒÆ’Ã‚Â¢ÃƒÂ¢Ã¢â€šÂ¬Ã…Â¡Ãƒâ€šÃ‚Â¬ÃƒÆ’Ã¢â‚¬Â¦Ãƒâ€šÃ‚Â¡ÃƒÆ’Ã†â€™Ãƒâ€ Ã¢â‚¬â„¢ÃƒÆ’Ã‚Â¢ÃƒÂ¢Ã¢â‚¬Å¡Ã‚Â¬Ãƒâ€¦Ã‚Â¡ÃƒÆ’Ã†â€™ÃƒÂ¢Ã¢â€šÂ¬Ã…Â¡ÃƒÆ’Ã¢â‚¬Å¡Ãƒâ€šÃ‚Â¢ÃƒÆ’Ã†â€™Ãƒâ€ Ã¢â‚¬â„¢ÃƒÆ’Ã¢â‚¬Â ÃƒÂ¢Ã¢â€šÂ¬Ã¢â€žÂ¢ÃƒÆ’Ã†â€™ÃƒÂ¢Ã¢â€šÂ¬Ã‚Â ÃƒÆ’Ã‚Â¢ÃƒÂ¢Ã¢â‚¬Å¡Ã‚Â¬ÃƒÂ¢Ã¢â‚¬Å¾Ã‚Â¢ÃƒÆ’Ã†â€™Ãƒâ€ Ã¢â‚¬â„¢ÃƒÆ’Ã‚Â¢ÃƒÂ¢Ã¢â‚¬Å¡Ã‚Â¬Ãƒâ€¦Ã‚Â¡ÃƒÆ’Ã†â€™ÃƒÂ¢Ã¢â€šÂ¬Ã…Â¡ÃƒÆ’Ã¢â‚¬Å¡Ãƒâ€šÃ‚Â¢ÃƒÆ’Ã†â€™Ãƒâ€ Ã¢â‚¬â„¢ÃƒÆ’Ã¢â‚¬Â ÃƒÂ¢Ã¢â€šÂ¬Ã¢â€žÂ¢ÃƒÆ’Ã†â€™ÃƒÂ¢Ã¢â€šÂ¬Ã…Â¡ÃƒÆ’Ã¢â‚¬Å¡Ãƒâ€šÃ‚Â¢ÃƒÆ’Ã†â€™Ãƒâ€ Ã¢â‚¬â„¢ÃƒÆ’Ã¢â‚¬Å¡Ãƒâ€šÃ‚Â¢ÃƒÆ’Ã†â€™Ãƒâ€šÃ‚Â¢ÃƒÆ’Ã‚Â¢ÃƒÂ¢Ã¢â€šÂ¬Ã…Â¡Ãƒâ€šÃ‚Â¬ÃƒÆ’Ã¢â‚¬Â¦Ãƒâ€šÃ‚Â¡ÃƒÆ’Ã†â€™ÃƒÂ¢Ã¢â€šÂ¬Ã…Â¡ÃƒÆ’Ã¢â‚¬Å¡Ãƒâ€šÃ‚Â¬ÃƒÆ’Ã†â€™Ãƒâ€ Ã¢â‚¬â„¢ÃƒÆ’Ã‚Â¢ÃƒÂ¢Ã¢â‚¬Å¡Ã‚Â¬Ãƒâ€šÃ‚Â¦ÃƒÆ’Ã†â€™ÃƒÂ¢Ã¢â€šÂ¬Ã…Â¡ÃƒÆ’Ã¢â‚¬Å¡Ãƒâ€šÃ‚Â¡ÃƒÆ’Ã†â€™Ãƒâ€ Ã¢â‚¬â„¢ÃƒÆ’Ã¢â‚¬Â ÃƒÂ¢Ã¢â€šÂ¬Ã¢â€žÂ¢ÃƒÆ’Ã†â€™Ãƒâ€šÃ‚Â¢ÃƒÆ’Ã‚Â¢ÃƒÂ¢Ã¢â€šÂ¬Ã…Â¡Ãƒâ€šÃ‚Â¬ÃƒÆ’Ã¢â‚¬Â¦Ãƒâ€šÃ‚Â¡ÃƒÆ’Ã†â€™Ãƒâ€ Ã¢â‚¬â„¢ÃƒÆ’Ã‚Â¢ÃƒÂ¢Ã¢â‚¬Å¡Ã‚Â¬Ãƒâ€¦Ã‚Â¡ÃƒÆ’Ã†â€™ÃƒÂ¢Ã¢â€šÂ¬Ã…Â¡ÃƒÆ’Ã¢â‚¬Å¡Ãƒâ€šÃ‚Â¬ÃƒÆ’Ã†â€™Ãƒâ€ Ã¢â‚¬â„¢ÃƒÆ’Ã¢â‚¬Â ÃƒÂ¢Ã¢â€šÂ¬Ã¢â€žÂ¢ÃƒÆ’Ã†â€™ÃƒÂ¢Ã¢â€šÂ¬Ã‚Â ÃƒÆ’Ã‚Â¢ÃƒÂ¢Ã¢â‚¬Å¡Ã‚Â¬ÃƒÂ¢Ã¢â‚¬Å¾Ã‚Â¢ÃƒÆ’Ã†â€™Ãƒâ€ Ã¢â‚¬â„¢ÃƒÆ’Ã¢â‚¬Å¡Ãƒâ€šÃ‚Â¢ÃƒÆ’Ã†â€™Ãƒâ€šÃ‚Â¢ÃƒÆ’Ã‚Â¢ÃƒÂ¢Ã¢â‚¬Å¡Ã‚Â¬Ãƒâ€¦Ã‚Â¡ÃƒÆ’Ã¢â‚¬Å¡Ãƒâ€šÃ‚Â¬ÃƒÆ’Ã†â€™ÃƒÂ¢Ã¢â€šÂ¬Ã…Â¡ÃƒÆ’Ã¢â‚¬Å¡Ãƒâ€šÃ‚Â¦ÃƒÆ’Ã†â€™Ãƒâ€ Ã¢â‚¬â„¢ÃƒÆ’Ã¢â‚¬Â ÃƒÂ¢Ã¢â€šÂ¬Ã¢â€žÂ¢ÃƒÆ’Ã†â€™Ãƒâ€šÃ‚Â¢ÃƒÆ’Ã‚Â¢ÃƒÂ¢Ã¢â€šÂ¬Ã…Â¡Ãƒâ€šÃ‚Â¬ÃƒÆ’Ã¢â‚¬Â¦Ãƒâ€šÃ‚Â¡ÃƒÆ’Ã†â€™Ãƒâ€ Ã¢â‚¬â„¢ÃƒÆ’Ã‚Â¢ÃƒÂ¢Ã¢â‚¬Å¡Ã‚Â¬Ãƒâ€¦Ã‚Â¡ÃƒÆ’Ã†â€™ÃƒÂ¢Ã¢â€šÂ¬Ã…Â¡ÃƒÆ’Ã¢â‚¬Å¡Ãƒâ€šÃ‚Â¡ÃƒÆ’Ã†â€™Ãƒâ€ Ã¢â‚¬â„¢ÃƒÆ’Ã¢â‚¬Â ÃƒÂ¢Ã¢â€šÂ¬Ã¢â€žÂ¢ÃƒÆ’Ã†â€™ÃƒÂ¢Ã¢â€šÂ¬Ã‚Â ÃƒÆ’Ã‚Â¢ÃƒÂ¢Ã¢â‚¬Å¡Ã‚Â¬ÃƒÂ¢Ã¢â‚¬Å¾Ã‚Â¢ÃƒÆ’Ã†â€™Ãƒâ€ Ã¢â‚¬â„¢ÃƒÆ’Ã‚Â¢ÃƒÂ¢Ã¢â‚¬Å¡Ã‚Â¬Ãƒâ€šÃ‚Â ÃƒÆ’Ã†â€™Ãƒâ€šÃ‚Â¢ÃƒÆ’Ã‚Â¢ÃƒÂ¢Ã¢â€šÂ¬Ã…Â¡Ãƒâ€šÃ‚Â¬ÃƒÆ’Ã‚Â¢ÃƒÂ¢Ã¢â€šÂ¬Ã…Â¾Ãƒâ€šÃ‚Â¢ÃƒÆ’Ã†â€™Ãƒâ€ Ã¢â‚¬â„¢ÃƒÆ’Ã¢â‚¬Â ÃƒÂ¢Ã¢â€šÂ¬Ã¢â€žÂ¢ÃƒÆ’Ã†â€™Ãƒâ€šÃ‚Â¢ÃƒÆ’Ã‚Â¢ÃƒÂ¢Ã¢â€šÂ¬Ã…Â¡Ãƒâ€šÃ‚Â¬ÃƒÆ’Ã¢â‚¬Å¡Ãƒâ€šÃ‚Â ÃƒÆ’Ã†â€™Ãƒâ€ Ã¢â‚¬â„¢ÃƒÆ’Ã¢â‚¬Å¡Ãƒâ€šÃ‚Â¢ÃƒÆ’Ã†â€™Ãƒâ€šÃ‚Â¢ÃƒÆ’Ã‚Â¢ÃƒÂ¢Ã¢â‚¬Å¡Ã‚Â¬Ãƒâ€¦Ã‚Â¡ÃƒÆ’Ã¢â‚¬Å¡Ãƒâ€šÃ‚Â¬ÃƒÆ’Ã†â€™Ãƒâ€šÃ‚Â¢ÃƒÆ’Ã‚Â¢ÃƒÂ¢Ã¢â‚¬Å¡Ã‚Â¬Ãƒâ€¦Ã‚Â¾ÃƒÆ’Ã¢â‚¬Å¡Ãƒâ€šÃ‚Â¢ÃƒÆ’Ã†â€™Ãƒâ€ Ã¢â‚¬â„¢ÃƒÆ’Ã¢â‚¬Â ÃƒÂ¢Ã¢â€šÂ¬Ã¢â€žÂ¢ÃƒÆ’Ã†â€™ÃƒÂ¢Ã¢â€šÂ¬Ã‚Â ÃƒÆ’Ã‚Â¢ÃƒÂ¢Ã¢â‚¬Å¡Ã‚Â¬ÃƒÂ¢Ã¢â‚¬Å¾Ã‚Â¢ÃƒÆ’Ã†â€™Ãƒâ€ Ã¢â‚¬â„¢ÃƒÆ’Ã‚Â¢ÃƒÂ¢Ã¢â‚¬Å¡Ã‚Â¬Ãƒâ€¦Ã‚Â¡ÃƒÆ’Ã†â€™ÃƒÂ¢Ã¢â€šÂ¬Ã…Â¡ÃƒÆ’Ã¢â‚¬Å¡Ãƒâ€šÃ‚Â¢ÃƒÆ’Ã†â€™Ãƒâ€ Ã¢â‚¬â„¢ÃƒÆ’Ã¢â‚¬Â ÃƒÂ¢Ã¢â€šÂ¬Ã¢â€žÂ¢ÃƒÆ’Ã†â€™ÃƒÂ¢Ã¢â€šÂ¬Ã…Â¡ÃƒÆ’Ã¢â‚¬Å¡Ãƒâ€šÃ‚Â¢ÃƒÆ’Ã†â€™Ãƒâ€ Ã¢â‚¬â„¢ÃƒÆ’Ã¢â‚¬Å¡Ãƒâ€šÃ‚Â¢ÃƒÆ’Ã†â€™Ãƒâ€šÃ‚Â¢ÃƒÆ’Ã‚Â¢ÃƒÂ¢Ã¢â‚¬Å¡Ã‚Â¬Ãƒâ€¦Ã‚Â¡ÃƒÆ’Ã¢â‚¬Å¡Ãƒâ€šÃ‚Â¬ÃƒÆ’Ã†â€™ÃƒÂ¢Ã¢â€šÂ¬Ã‚Â¦ÃƒÆ’Ã¢â‚¬Å¡Ãƒâ€šÃ‚Â¡ÃƒÆ’Ã†â€™Ãƒâ€ Ã¢â‚¬â„¢ÃƒÆ’Ã‚Â¢ÃƒÂ¢Ã¢â‚¬Å¡Ã‚Â¬Ãƒâ€¦Ã‚Â¡ÃƒÆ’Ã†â€™ÃƒÂ¢Ã¢â€šÂ¬Ã…Â¡ÃƒÆ’Ã¢â‚¬Å¡Ãƒâ€šÃ‚Â¬ÃƒÆ’Ã†â€™Ãƒâ€ Ã¢â‚¬â„¢ÃƒÆ’Ã¢â‚¬Â ÃƒÂ¢Ã¢â€šÂ¬Ã¢â€žÂ¢ÃƒÆ’Ã†â€™Ãƒâ€šÃ‚Â¢ÃƒÆ’Ã‚Â¢ÃƒÂ¢Ã¢â€šÂ¬Ã…Â¡Ãƒâ€šÃ‚Â¬ÃƒÆ’Ã¢â‚¬Å¡Ãƒâ€šÃ‚Â¦ÃƒÆ’Ã†â€™Ãƒâ€ Ã¢â‚¬â„¢ÃƒÆ’Ã‚Â¢ÃƒÂ¢Ã¢â‚¬Å¡Ã‚Â¬Ãƒâ€¦Ã‚Â¡ÃƒÆ’Ã†â€™ÃƒÂ¢Ã¢â€šÂ¬Ã…Â¡ÃƒÆ’Ã¢â‚¬Å¡Ãƒâ€šÃ‚Â¡ÃƒÆ’Ã†â€™Ãƒâ€ Ã¢â‚¬â„¢ÃƒÆ’Ã¢â‚¬Â ÃƒÂ¢Ã¢â€šÂ¬Ã¢â€žÂ¢ÃƒÆ’Ã†â€™ÃƒÂ¢Ã¢â€šÂ¬Ã‚Â ÃƒÆ’Ã‚Â¢ÃƒÂ¢Ã¢â‚¬Å¡Ã‚Â¬ÃƒÂ¢Ã¢â‚¬Å¾Ã‚Â¢ÃƒÆ’Ã†â€™Ãƒâ€ Ã¢â‚¬â„¢ÃƒÆ’Ã‚Â¢ÃƒÂ¢Ã¢â‚¬Å¡Ã‚Â¬Ãƒâ€šÃ‚Â ÃƒÆ’Ã†â€™Ãƒâ€šÃ‚Â¢ÃƒÆ’Ã‚Â¢ÃƒÂ¢Ã¢â€šÂ¬Ã…Â¡Ãƒâ€šÃ‚Â¬ÃƒÆ’Ã‚Â¢ÃƒÂ¢Ã¢â€šÂ¬Ã…Â¾Ãƒâ€šÃ‚Â¢ÃƒÆ’Ã†â€™Ãƒâ€ Ã¢â‚¬â„¢ÃƒÆ’Ã¢â‚¬Â ÃƒÂ¢Ã¢â€šÂ¬Ã¢â€žÂ¢ÃƒÆ’Ã†â€™ÃƒÂ¢Ã¢â€šÂ¬Ã…Â¡ÃƒÆ’Ã¢â‚¬Å¡Ãƒâ€šÃ‚Â¢ÃƒÆ’Ã†â€™Ãƒâ€ Ã¢â‚¬â„¢ÃƒÆ’Ã¢â‚¬Å¡Ãƒâ€šÃ‚Â¢ÃƒÆ’Ã†â€™Ãƒâ€šÃ‚Â¢ÃƒÆ’Ã‚Â¢ÃƒÂ¢Ã¢â€šÂ¬Ã…Â¡Ãƒâ€šÃ‚Â¬ÃƒÆ’Ã¢â‚¬Â¦Ãƒâ€šÃ‚Â¡ÃƒÆ’Ã†â€™ÃƒÂ¢Ã¢â€šÂ¬Ã…Â¡ÃƒÆ’Ã¢â‚¬Å¡Ãƒâ€šÃ‚Â¬ÃƒÆ’Ã†â€™Ãƒâ€ Ã¢â‚¬â„¢ÃƒÆ’Ã‚Â¢ÃƒÂ¢Ã¢â‚¬Å¡Ã‚Â¬Ãƒâ€šÃ‚Â¦ÃƒÆ’Ã†â€™ÃƒÂ¢Ã¢â€šÂ¬Ã…Â¡ÃƒÆ’Ã¢â‚¬Å¡Ãƒâ€šÃ‚Â¡ÃƒÆ’Ã†â€™Ãƒâ€ Ã¢â‚¬â„¢ÃƒÆ’Ã¢â‚¬Â ÃƒÂ¢Ã¢â€šÂ¬Ã¢â€žÂ¢ÃƒÆ’Ã†â€™ÃƒÂ¢Ã¢â€šÂ¬Ã‚Â ÃƒÆ’Ã‚Â¢ÃƒÂ¢Ã¢â‚¬Å¡Ã‚Â¬ÃƒÂ¢Ã¢â‚¬Å¾Ã‚Â¢ÃƒÆ’Ã†â€™Ãƒâ€ Ã¢â‚¬â„¢ÃƒÆ’Ã¢â‚¬Å¡Ãƒâ€šÃ‚Â¢ÃƒÆ’Ã†â€™Ãƒâ€šÃ‚Â¢ÃƒÆ’Ã‚Â¢ÃƒÂ¢Ã¢â‚¬Å¡Ã‚Â¬Ãƒâ€¦Ã‚Â¡ÃƒÆ’Ã¢â‚¬Å¡Ãƒâ€šÃ‚Â¬ÃƒÆ’Ã†â€™ÃƒÂ¢Ã¢â€šÂ¬Ã‚Â¦ÃƒÆ’Ã¢â‚¬Å¡Ãƒâ€šÃ‚Â¡ÃƒÆ’Ã†â€™Ãƒâ€ Ã¢â‚¬â„¢ÃƒÆ’Ã¢â‚¬Â ÃƒÂ¢Ã¢â€šÂ¬Ã¢â€žÂ¢ÃƒÆ’Ã†â€™Ãƒâ€šÃ‚Â¢ÃƒÆ’Ã‚Â¢ÃƒÂ¢Ã¢â€šÂ¬Ã…Â¡Ãƒâ€šÃ‚Â¬ÃƒÆ’Ã¢â‚¬Â¦Ãƒâ€šÃ‚Â¡ÃƒÆ’Ã†â€™Ãƒâ€ Ã¢â‚¬â„¢ÃƒÆ’Ã‚Â¢ÃƒÂ¢Ã¢â‚¬Å¡Ã‚Â¬Ãƒâ€¦Ã‚Â¡ÃƒÆ’Ã†â€™ÃƒÂ¢Ã¢â€šÂ¬Ã…Â¡ÃƒÆ’Ã¢â‚¬Å¡Ãƒâ€šÃ‚Â°C in IMTA). Following this decline, temperatures increased sharply in Week 5 and then remained relatively stable through Weeks 6 and 7 at approximately 28.1ÃƒÆ’Ã†â€™Ãƒâ€ Ã¢â‚¬â„¢ÃƒÆ’Ã¢â‚¬Â ÃƒÂ¢Ã¢â€šÂ¬Ã¢â€žÂ¢ÃƒÆ’Ã†â€™ÃƒÂ¢Ã¢â€šÂ¬Ã‚Â ÃƒÆ’Ã‚Â¢ÃƒÂ¢Ã¢â‚¬Å¡Ã‚Â¬ÃƒÂ¢Ã¢â‚¬Å¾Ã‚Â¢ÃƒÆ’Ã†â€™Ãƒâ€ Ã¢â‚¬â„¢ÃƒÆ’Ã‚Â¢ÃƒÂ¢Ã¢â‚¬Å¡Ã‚Â¬Ãƒâ€šÃ‚Â ÃƒÆ’Ã†â€™Ãƒâ€šÃ‚Â¢ÃƒÆ’Ã‚Â¢ÃƒÂ¢Ã¢â€šÂ¬Ã…Â¡Ãƒâ€šÃ‚Â¬ÃƒÆ’Ã‚Â¢ÃƒÂ¢Ã¢â€šÂ¬Ã…Â¾Ãƒâ€šÃ‚Â¢ÃƒÆ’Ã†â€™Ãƒâ€ Ã¢â‚¬â„¢ÃƒÆ’Ã¢â‚¬Â ÃƒÂ¢Ã¢â€šÂ¬Ã¢â€žÂ¢ÃƒÆ’Ã†â€™Ãƒâ€šÃ‚Â¢ÃƒÆ’Ã‚Â¢ÃƒÂ¢Ã¢â€šÂ¬Ã…Â¡Ãƒâ€šÃ‚Â¬ÃƒÆ’Ã¢â‚¬Å¡Ãƒâ€šÃ‚Â ÃƒÆ’Ã†â€™Ãƒâ€ Ã¢â‚¬â„¢ÃƒÆ’Ã¢â‚¬Å¡Ãƒâ€šÃ‚Â¢ÃƒÆ’Ã†â€™Ãƒâ€šÃ‚Â¢ÃƒÆ’Ã‚Â¢ÃƒÂ¢Ã¢â‚¬Å¡Ã‚Â¬Ãƒâ€¦Ã‚Â¡ÃƒÆ’Ã¢â‚¬Å¡Ãƒâ€šÃ‚Â¬ÃƒÆ’Ã†â€™Ãƒâ€šÃ‚Â¢ÃƒÆ’Ã‚Â¢ÃƒÂ¢Ã¢â‚¬Å¡Ã‚Â¬Ãƒâ€¦Ã‚Â¾ÃƒÆ’Ã¢â‚¬Å¡Ãƒâ€šÃ‚Â¢ÃƒÆ’Ã†â€™Ãƒâ€ Ã¢â‚¬â„¢ÃƒÆ’Ã¢â‚¬Â ÃƒÂ¢Ã¢â€šÂ¬Ã¢â€žÂ¢ÃƒÆ’Ã†â€™ÃƒÂ¢Ã¢â€šÂ¬Ã‚Â ÃƒÆ’Ã‚Â¢ÃƒÂ¢Ã¢â‚¬Å¡Ã‚Â¬ÃƒÂ¢Ã¢â‚¬Å¾Ã‚Â¢ÃƒÆ’Ã†â€™Ãƒâ€ Ã¢â‚¬â„¢ÃƒÆ’Ã¢â‚¬Å¡Ãƒâ€šÃ‚Â¢ÃƒÆ’Ã†â€™Ãƒâ€šÃ‚Â¢ÃƒÆ’Ã‚Â¢ÃƒÂ¢Ã¢â‚¬Å¡Ã‚Â¬Ãƒâ€¦Ã‚Â¡ÃƒÆ’Ã¢â‚¬Å¡Ãƒâ€šÃ‚Â¬ÃƒÆ’Ã†â€™ÃƒÂ¢Ã¢â€šÂ¬Ã…Â¡ÃƒÆ’Ã¢â‚¬Å¡Ãƒâ€šÃ‚Â ÃƒÆ’Ã†â€™Ãƒâ€ Ã¢â‚¬â„¢ÃƒÆ’Ã¢â‚¬Â ÃƒÂ¢Ã¢â€šÂ¬Ã¢â€žÂ¢ÃƒÆ’Ã†â€™ÃƒÂ¢Ã¢â€šÂ¬Ã…Â¡ÃƒÆ’Ã¢â‚¬Å¡Ãƒâ€šÃ‚Â¢ÃƒÆ’Ã†â€™Ãƒâ€ Ã¢â‚¬â„¢ÃƒÆ’Ã¢â‚¬Å¡Ãƒâ€šÃ‚Â¢ÃƒÆ’Ã†â€™Ãƒâ€šÃ‚Â¢ÃƒÆ’Ã‚Â¢ÃƒÂ¢Ã¢â€šÂ¬Ã…Â¡Ãƒâ€šÃ‚Â¬ÃƒÆ’Ã¢â‚¬Â¦Ãƒâ€šÃ‚Â¡ÃƒÆ’Ã†â€™ÃƒÂ¢Ã¢â€šÂ¬Ã…Â¡ÃƒÆ’Ã¢â‚¬Å¡Ãƒâ€šÃ‚Â¬ÃƒÆ’Ã†â€™Ãƒâ€ Ã¢â‚¬â„¢ÃƒÆ’Ã¢â‚¬Å¡Ãƒâ€šÃ‚Â¢ÃƒÆ’Ã†â€™Ãƒâ€šÃ‚Â¢ÃƒÆ’Ã‚Â¢ÃƒÂ¢Ã¢â€šÂ¬Ã…Â¡Ãƒâ€šÃ‚Â¬ÃƒÆ’Ã¢â‚¬Â¦Ãƒâ€šÃ‚Â¾ÃƒÆ’Ã†â€™ÃƒÂ¢Ã¢â€šÂ¬Ã…Â¡ÃƒÆ’Ã¢â‚¬Å¡Ãƒâ€šÃ‚Â¢ÃƒÆ’Ã†â€™Ãƒâ€ Ã¢â‚¬â„¢ÃƒÆ’Ã¢â‚¬Â ÃƒÂ¢Ã¢â€šÂ¬Ã¢â€žÂ¢ÃƒÆ’Ã†â€™ÃƒÂ¢Ã¢â€šÂ¬Ã‚Â ÃƒÆ’Ã‚Â¢ÃƒÂ¢Ã¢â‚¬Å¡Ã‚Â¬ÃƒÂ¢Ã¢â‚¬Å¾Ã‚Â¢ÃƒÆ’Ã†â€™Ãƒâ€ Ã¢â‚¬â„¢ÃƒÆ’Ã‚Â¢ÃƒÂ¢Ã¢â‚¬Å¡Ã‚Â¬Ãƒâ€šÃ‚Â ÃƒÆ’Ã†â€™Ãƒâ€šÃ‚Â¢ÃƒÆ’Ã‚Â¢ÃƒÂ¢Ã¢â€šÂ¬Ã…Â¡Ãƒâ€šÃ‚Â¬ÃƒÆ’Ã‚Â¢ÃƒÂ¢Ã¢â€šÂ¬Ã…Â¾Ãƒâ€šÃ‚Â¢ÃƒÆ’Ã†â€™Ãƒâ€ Ã¢â‚¬â„¢ÃƒÆ’Ã¢â‚¬Â ÃƒÂ¢Ã¢â€šÂ¬Ã¢â€žÂ¢ÃƒÆ’Ã†â€™Ãƒâ€šÃ‚Â¢ÃƒÆ’Ã‚Â¢ÃƒÂ¢Ã¢â€šÂ¬Ã…Â¡Ãƒâ€šÃ‚Â¬ÃƒÆ’Ã¢â‚¬Â¦Ãƒâ€šÃ‚Â¡ÃƒÆ’Ã†â€™Ãƒâ€ Ã¢â‚¬â„¢ÃƒÆ’Ã‚Â¢ÃƒÂ¢Ã¢â‚¬Å¡Ã‚Â¬Ãƒâ€¦Ã‚Â¡ÃƒÆ’Ã†â€™ÃƒÂ¢Ã¢â€šÂ¬Ã…Â¡ÃƒÆ’Ã¢â‚¬Å¡Ãƒâ€šÃ‚Â¢ÃƒÆ’Ã†â€™Ãƒâ€ Ã¢â‚¬â„¢ÃƒÆ’Ã¢â‚¬Â ÃƒÂ¢Ã¢â€šÂ¬Ã¢â€žÂ¢ÃƒÆ’Ã†â€™ÃƒÂ¢Ã¢â€šÂ¬Ã‚Â ÃƒÆ’Ã‚Â¢ÃƒÂ¢Ã¢â‚¬Å¡Ã‚Â¬ÃƒÂ¢Ã¢â‚¬Å¾Ã‚Â¢ÃƒÆ’Ã†â€™Ãƒâ€ Ã¢â‚¬â„¢ÃƒÆ’Ã‚Â¢ÃƒÂ¢Ã¢â‚¬Å¡Ã‚Â¬Ãƒâ€¦Ã‚Â¡ÃƒÆ’Ã†â€™ÃƒÂ¢Ã¢â€šÂ¬Ã…Â¡ÃƒÆ’Ã¢â‚¬Å¡Ãƒâ€šÃ‚Â¢ÃƒÆ’Ã†â€™Ãƒâ€ Ã¢â‚¬â„¢ÃƒÆ’Ã¢â‚¬Â ÃƒÂ¢Ã¢â€šÂ¬Ã¢â€žÂ¢ÃƒÆ’Ã†â€™ÃƒÂ¢Ã¢â€šÂ¬Ã…Â¡ÃƒÆ’Ã¢â‚¬Å¡Ãƒâ€šÃ‚Â¢ÃƒÆ’Ã†â€™Ãƒâ€ Ã¢â‚¬â„¢ÃƒÆ’Ã¢â‚¬Å¡Ãƒâ€šÃ‚Â¢ÃƒÆ’Ã†â€™Ãƒâ€šÃ‚Â¢ÃƒÆ’Ã‚Â¢ÃƒÂ¢Ã¢â€šÂ¬Ã…Â¡Ãƒâ€šÃ‚Â¬ÃƒÆ’Ã¢â‚¬Â¦Ãƒâ€šÃ‚Â¡ÃƒÆ’Ã†â€™ÃƒÂ¢Ã¢â€šÂ¬Ã…Â¡ÃƒÆ’Ã¢â‚¬Å¡Ãƒâ€šÃ‚Â¬ÃƒÆ’Ã†â€™Ãƒâ€ Ã¢â‚¬â„¢ÃƒÆ’Ã‚Â¢ÃƒÂ¢Ã¢â‚¬Å¡Ã‚Â¬Ãƒâ€šÃ‚Â¦ÃƒÆ’Ã†â€™ÃƒÂ¢Ã¢â€šÂ¬Ã…Â¡ÃƒÆ’Ã¢â‚¬Å¡Ãƒâ€šÃ‚Â¡ÃƒÆ’Ã†â€™Ãƒâ€ Ã¢â‚¬â„¢ÃƒÆ’Ã¢â‚¬Â ÃƒÂ¢Ã¢â€šÂ¬Ã¢â€žÂ¢ÃƒÆ’Ã†â€™Ãƒâ€šÃ‚Â¢ÃƒÆ’Ã‚Â¢ÃƒÂ¢Ã¢â€šÂ¬Ã…Â¡Ãƒâ€šÃ‚Â¬ÃƒÆ’Ã¢â‚¬Â¦Ãƒâ€šÃ‚Â¡ÃƒÆ’Ã†â€™Ãƒâ€ Ã¢â‚¬â„¢ÃƒÆ’Ã‚Â¢ÃƒÂ¢Ã¢â‚¬Å¡Ã‚Â¬Ãƒâ€¦Ã‚Â¡ÃƒÆ’Ã†â€™ÃƒÂ¢Ã¢â€šÂ¬Ã…Â¡ÃƒÆ’Ã¢â‚¬Å¡Ãƒâ€šÃ‚Â¬ÃƒÆ’Ã†â€™Ãƒâ€ Ã¢â‚¬â„¢ÃƒÆ’Ã¢â‚¬Â ÃƒÂ¢Ã¢â€šÂ¬Ã¢â€žÂ¢ÃƒÆ’Ã†â€™ÃƒÂ¢Ã¢â€šÂ¬Ã‚Â ÃƒÆ’Ã‚Â¢ÃƒÂ¢Ã¢â‚¬Å¡Ã‚Â¬ÃƒÂ¢Ã¢â‚¬Å¾Ã‚Â¢ÃƒÆ’Ã†â€™Ãƒâ€ Ã¢â‚¬â„¢ÃƒÆ’Ã¢â‚¬Å¡Ãƒâ€šÃ‚Â¢ÃƒÆ’Ã†â€™Ãƒâ€šÃ‚Â¢ÃƒÆ’Ã‚Â¢ÃƒÂ¢Ã¢â‚¬Å¡Ã‚Â¬Ãƒâ€¦Ã‚Â¡ÃƒÆ’Ã¢â‚¬Å¡Ãƒâ€šÃ‚Â¬ÃƒÆ’Ã†â€™ÃƒÂ¢Ã¢â€šÂ¬Ã…Â¡ÃƒÆ’Ã¢â‚¬Å¡Ãƒâ€šÃ‚Â¦ÃƒÆ’Ã†â€™Ãƒâ€ Ã¢â‚¬â„¢ÃƒÆ’Ã¢â‚¬Â ÃƒÂ¢Ã¢â€šÂ¬Ã¢â€žÂ¢ÃƒÆ’Ã†â€™Ãƒâ€šÃ‚Â¢ÃƒÆ’Ã‚Â¢ÃƒÂ¢Ã¢â€šÂ¬Ã…Â¡Ãƒâ€šÃ‚Â¬ÃƒÆ’Ã¢â‚¬Â¦Ãƒâ€šÃ‚Â¡ÃƒÆ’Ã†â€™Ãƒâ€ Ã¢â‚¬â„¢ÃƒÆ’Ã‚Â¢ÃƒÂ¢Ã¢â‚¬Å¡Ã‚Â¬Ãƒâ€¦Ã‚Â¡ÃƒÆ’Ã†â€™ÃƒÂ¢Ã¢â€šÂ¬Ã…Â¡ÃƒÆ’Ã¢â‚¬Å¡Ãƒâ€šÃ‚Â¡ÃƒÆ’Ã†â€™Ãƒâ€ Ã¢â‚¬â„¢ÃƒÆ’Ã¢â‚¬Â ÃƒÂ¢Ã¢â€šÂ¬Ã¢â€žÂ¢ÃƒÆ’Ã†â€™ÃƒÂ¢Ã¢â€šÂ¬Ã‚Â ÃƒÆ’Ã‚Â¢ÃƒÂ¢Ã¢â‚¬Å¡Ã‚Â¬ÃƒÂ¢Ã¢â‚¬Å¾Ã‚Â¢ÃƒÆ’Ã†â€™Ãƒâ€ Ã¢â‚¬â„¢ÃƒÆ’Ã‚Â¢ÃƒÂ¢Ã¢â‚¬Å¡Ã‚Â¬Ãƒâ€šÃ‚Â ÃƒÆ’Ã†â€™Ãƒâ€šÃ‚Â¢ÃƒÆ’Ã‚Â¢ÃƒÂ¢Ã¢â€šÂ¬Ã…Â¡Ãƒâ€šÃ‚Â¬ÃƒÆ’Ã‚Â¢ÃƒÂ¢Ã¢â€šÂ¬Ã…Â¾Ãƒâ€šÃ‚Â¢ÃƒÆ’Ã†â€™Ãƒâ€ Ã¢â‚¬â„¢ÃƒÆ’Ã¢â‚¬Â ÃƒÂ¢Ã¢â€šÂ¬Ã¢â€žÂ¢ÃƒÆ’Ã†â€™Ãƒâ€šÃ‚Â¢ÃƒÆ’Ã‚Â¢ÃƒÂ¢Ã¢â€šÂ¬Ã…Â¡Ãƒâ€šÃ‚Â¬ÃƒÆ’Ã¢â‚¬Å¡Ãƒâ€šÃ‚Â ÃƒÆ’Ã†â€™Ãƒâ€ Ã¢â‚¬â„¢ÃƒÆ’Ã¢â‚¬Å¡Ãƒâ€šÃ‚Â¢ÃƒÆ’Ã†â€™Ãƒâ€šÃ‚Â¢ÃƒÆ’Ã‚Â¢ÃƒÂ¢Ã¢â‚¬Å¡Ã‚Â¬Ãƒâ€¦Ã‚Â¡ÃƒÆ’Ã¢â‚¬Å¡Ãƒâ€šÃ‚Â¬ÃƒÆ’Ã†â€™Ãƒâ€šÃ‚Â¢ÃƒÆ’Ã‚Â¢ÃƒÂ¢Ã¢â‚¬Å¡Ã‚Â¬Ãƒâ€¦Ã‚Â¾ÃƒÆ’Ã¢â‚¬Å¡Ãƒâ€šÃ‚Â¢ÃƒÆ’Ã†â€™Ãƒâ€ Ã¢â‚¬â„¢ÃƒÆ’Ã¢â‚¬Â ÃƒÂ¢Ã¢â€šÂ¬Ã¢â€žÂ¢ÃƒÆ’Ã†â€™ÃƒÂ¢Ã¢â€šÂ¬Ã‚Â ÃƒÆ’Ã‚Â¢ÃƒÂ¢Ã¢â‚¬Å¡Ã‚Â¬ÃƒÂ¢Ã¢â‚¬Å¾Ã‚Â¢ÃƒÆ’Ã†â€™Ãƒâ€ Ã¢â‚¬â„¢ÃƒÆ’Ã‚Â¢ÃƒÂ¢Ã¢â‚¬Å¡Ã‚Â¬Ãƒâ€¦Ã‚Â¡ÃƒÆ’Ã†â€™ÃƒÂ¢Ã¢â€šÂ¬Ã…Â¡ÃƒÆ’Ã¢â‚¬Å¡Ãƒâ€šÃ‚Â¢ÃƒÆ’Ã†â€™Ãƒâ€ Ã¢â‚¬â„¢ÃƒÆ’Ã¢â‚¬Â ÃƒÂ¢Ã¢â€šÂ¬Ã¢â€žÂ¢ÃƒÆ’Ã†â€™ÃƒÂ¢Ã¢â€šÂ¬Ã…Â¡ÃƒÆ’Ã¢â‚¬Å¡Ãƒâ€šÃ‚Â¢ÃƒÆ’Ã†â€™Ãƒâ€ Ã¢â‚¬â„¢ÃƒÆ’Ã¢â‚¬Å¡Ãƒâ€šÃ‚Â¢ÃƒÆ’Ã†â€™Ãƒâ€šÃ‚Â¢ÃƒÆ’Ã‚Â¢ÃƒÂ¢Ã¢â‚¬Å¡Ã‚Â¬Ãƒâ€¦Ã‚Â¡ÃƒÆ’Ã¢â‚¬Å¡Ãƒâ€šÃ‚Â¬ÃƒÆ’Ã†â€™ÃƒÂ¢Ã¢â€šÂ¬Ã‚Â¦ÃƒÆ’Ã¢â‚¬Å¡Ãƒâ€šÃ‚Â¡ÃƒÆ’Ã†â€™Ãƒâ€ Ã¢â‚¬â„¢ÃƒÆ’Ã‚Â¢ÃƒÂ¢Ã¢â‚¬Å¡Ã‚Â¬Ãƒâ€¦Ã‚Â¡ÃƒÆ’Ã†â€™ÃƒÂ¢Ã¢â€šÂ¬Ã…Â¡ÃƒÆ’Ã¢â‚¬Å¡Ãƒâ€šÃ‚Â¬ÃƒÆ’Ã†â€™Ãƒâ€ Ã¢â‚¬â„¢ÃƒÆ’Ã¢â‚¬Â ÃƒÂ¢Ã¢â€šÂ¬Ã¢â€žÂ¢ÃƒÆ’Ã†â€™Ãƒâ€šÃ‚Â¢ÃƒÆ’Ã‚Â¢ÃƒÂ¢Ã¢â€šÂ¬Ã…Â¡Ãƒâ€šÃ‚Â¬ÃƒÆ’Ã¢â‚¬Å¡Ãƒâ€šÃ‚Â¦ÃƒÆ’Ã†â€™Ãƒâ€ Ã¢â‚¬â„¢ÃƒÆ’Ã‚Â¢ÃƒÂ¢Ã¢â‚¬Å¡Ã‚Â¬Ãƒâ€¦Ã‚Â¡ÃƒÆ’Ã†â€™ÃƒÂ¢Ã¢â€šÂ¬Ã…Â¡ÃƒÆ’Ã¢â‚¬Å¡Ãƒâ€šÃ‚Â¡ÃƒÆ’Ã†â€™Ãƒâ€ Ã¢â‚¬â„¢ÃƒÆ’Ã¢â‚¬Â ÃƒÂ¢Ã¢â€šÂ¬Ã¢â€žÂ¢ÃƒÆ’Ã†â€™ÃƒÂ¢Ã¢â€šÂ¬Ã‚Â ÃƒÆ’Ã‚Â¢ÃƒÂ¢Ã¢â‚¬Å¡Ã‚Â¬ÃƒÂ¢Ã¢â‚¬Å¾Ã‚Â¢ÃƒÆ’Ã†â€™Ãƒâ€ Ã¢â‚¬â„¢ÃƒÆ’Ã‚Â¢ÃƒÂ¢Ã¢â‚¬Å¡Ã‚Â¬Ãƒâ€šÃ‚Â ÃƒÆ’Ã†â€™Ãƒâ€šÃ‚Â¢ÃƒÆ’Ã‚Â¢ÃƒÂ¢Ã¢â€šÂ¬Ã…Â¡Ãƒâ€šÃ‚Â¬ÃƒÆ’Ã‚Â¢ÃƒÂ¢Ã¢â€šÂ¬Ã…Â¾Ãƒâ€šÃ‚Â¢ÃƒÆ’Ã†â€™Ãƒâ€ Ã¢â‚¬â„¢ÃƒÆ’Ã¢â‚¬Â ÃƒÂ¢Ã¢â€šÂ¬Ã¢â€žÂ¢ÃƒÆ’Ã†â€™ÃƒÂ¢Ã¢â€šÂ¬Ã…Â¡ÃƒÆ’Ã¢â‚¬Å¡Ãƒâ€šÃ‚Â¢ÃƒÆ’Ã†â€™Ãƒâ€ Ã¢â‚¬â„¢ÃƒÆ’Ã¢â‚¬Å¡Ãƒâ€šÃ‚Â¢ÃƒÆ’Ã†â€™Ãƒâ€šÃ‚Â¢ÃƒÆ’Ã‚Â¢ÃƒÂ¢Ã¢â€šÂ¬Ã…Â¡Ãƒâ€šÃ‚Â¬ÃƒÆ’Ã¢â‚¬Â¦Ãƒâ€šÃ‚Â¡ÃƒÆ’Ã†â€™ÃƒÂ¢Ã¢â€šÂ¬Ã…Â¡ÃƒÆ’Ã¢â‚¬Å¡Ãƒâ€šÃ‚Â¬ÃƒÆ’Ã†â€™Ãƒâ€ Ã¢â‚¬â„¢ÃƒÆ’Ã‚Â¢ÃƒÂ¢Ã¢â‚¬Å¡Ã‚Â¬Ãƒâ€šÃ‚Â¦ÃƒÆ’Ã†â€™ÃƒÂ¢Ã¢â€šÂ¬Ã…Â¡ÃƒÆ’Ã¢â‚¬Å¡Ãƒâ€šÃ‚Â¡ÃƒÆ’Ã†â€™Ãƒâ€ Ã¢â‚¬â„¢ÃƒÆ’Ã¢â‚¬Â ÃƒÂ¢Ã¢â€šÂ¬Ã¢â€žÂ¢ÃƒÆ’Ã†â€™ÃƒÂ¢Ã¢â€šÂ¬Ã‚Â ÃƒÆ’Ã‚Â¢ÃƒÂ¢Ã¢â‚¬Å¡Ã‚Â¬ÃƒÂ¢Ã¢â‚¬Å¾Ã‚Â¢ÃƒÆ’Ã†â€™Ãƒâ€ Ã¢â‚¬â„¢ÃƒÆ’Ã¢â‚¬Å¡Ãƒâ€šÃ‚Â¢ÃƒÆ’Ã†â€™Ãƒâ€šÃ‚Â¢ÃƒÆ’Ã‚Â¢ÃƒÂ¢Ã¢â‚¬Å¡Ã‚Â¬Ãƒâ€¦Ã‚Â¡ÃƒÆ’Ã¢â‚¬Å¡Ãƒâ€šÃ‚Â¬ÃƒÆ’Ã†â€™ÃƒÂ¢Ã¢â€šÂ¬Ã‚Â¦ÃƒÆ’Ã¢â‚¬Å¡Ãƒâ€šÃ‚Â¡ÃƒÆ’Ã†â€™Ãƒâ€ Ã¢â‚¬â„¢ÃƒÆ’Ã¢â‚¬Â ÃƒÂ¢Ã¢â€šÂ¬Ã¢â€žÂ¢ÃƒÆ’Ã†â€™Ãƒâ€šÃ‚Â¢ÃƒÆ’Ã‚Â¢ÃƒÂ¢Ã¢â€šÂ¬Ã…Â¡Ãƒâ€šÃ‚Â¬ÃƒÆ’Ã¢â‚¬Â¦Ãƒâ€šÃ‚Â¡ÃƒÆ’Ã†â€™Ãƒâ€ Ã¢â‚¬â„¢ÃƒÆ’Ã‚Â¢ÃƒÂ¢Ã¢â‚¬Å¡Ã‚Â¬Ãƒâ€¦Ã‚Â¡ÃƒÆ’Ã†â€™ÃƒÂ¢Ã¢â€šÂ¬Ã…Â¡ÃƒÆ’Ã¢â‚¬Å¡Ãƒâ€šÃ‚Â°C in both systems.</w:t>
       </w:r>
     </w:p>
     <w:p>
@@ -7018,7 +7018,7 @@
               <w:rPr>
                 <w:rFonts w:ascii="Times New Roman" w:hAnsi="Times New Roman" w:cs="Times New Roman"/>
               </w:rPr>
-              <w:t>pH (Mean ÃƒÆ’Ã†â€™Ãƒâ€ Ã¢â‚¬â„¢ÃƒÆ’Ã¢â‚¬Â ÃƒÂ¢Ã¢â€šÂ¬Ã¢â€žÂ¢ÃƒÆ’Ã†â€™ÃƒÂ¢Ã¢â€šÂ¬Ã‚Â ÃƒÆ’Ã‚Â¢ÃƒÂ¢Ã¢â‚¬Å¡Ã‚Â¬ÃƒÂ¢Ã¢â‚¬Å¾Ã‚Â¢ÃƒÆ’Ã†â€™Ãƒâ€ Ã¢â‚¬â„¢ÃƒÆ’Ã‚Â¢ÃƒÂ¢Ã¢â‚¬Å¡Ã‚Â¬Ãƒâ€šÃ‚Â ÃƒÆ’Ã†â€™Ãƒâ€šÃ‚Â¢ÃƒÆ’Ã‚Â¢ÃƒÂ¢Ã¢â€šÂ¬Ã…Â¡Ãƒâ€šÃ‚Â¬ÃƒÆ’Ã‚Â¢ÃƒÂ¢Ã¢â€šÂ¬Ã…Â¾Ãƒâ€šÃ‚Â¢ÃƒÆ’Ã†â€™Ãƒâ€ Ã¢â‚¬â„¢ÃƒÆ’Ã¢â‚¬Â ÃƒÂ¢Ã¢â€šÂ¬Ã¢â€žÂ¢ÃƒÆ’Ã†â€™Ãƒâ€šÃ‚Â¢ÃƒÆ’Ã‚Â¢ÃƒÂ¢Ã¢â€šÂ¬Ã…Â¡Ãƒâ€šÃ‚Â¬ÃƒÆ’Ã¢â‚¬Å¡Ãƒâ€šÃ‚Â ÃƒÆ’Ã†â€™Ãƒâ€ Ã¢â‚¬â„¢ÃƒÆ’Ã¢â‚¬Å¡Ãƒâ€šÃ‚Â¢ÃƒÆ’Ã†â€™Ãƒâ€šÃ‚Â¢ÃƒÆ’Ã‚Â¢ÃƒÂ¢Ã¢â‚¬Å¡Ã‚Â¬Ãƒâ€¦Ã‚Â¡ÃƒÆ’Ã¢â‚¬Å¡Ãƒâ€šÃ‚Â¬ÃƒÆ’Ã†â€™Ãƒâ€šÃ‚Â¢ÃƒÆ’Ã‚Â¢ÃƒÂ¢Ã¢â‚¬Å¡Ã‚Â¬Ãƒâ€¦Ã‚Â¾ÃƒÆ’Ã¢â‚¬Å¡Ãƒâ€šÃ‚Â¢ÃƒÆ’Ã†â€™Ãƒâ€ Ã¢â‚¬â„¢ÃƒÆ’Ã¢â‚¬Â ÃƒÂ¢Ã¢â€šÂ¬Ã¢â€žÂ¢ÃƒÆ’Ã†â€™ÃƒÂ¢Ã¢â€šÂ¬Ã‚Â ÃƒÆ’Ã‚Â¢ÃƒÂ¢Ã¢â‚¬Å¡Ã‚Â¬ÃƒÂ¢Ã¢â‚¬Å¾Ã‚Â¢ÃƒÆ’Ã†â€™Ãƒâ€ Ã¢â‚¬â„¢ÃƒÆ’Ã‚Â¢ÃƒÂ¢Ã¢â‚¬Å¡Ã‚Â¬Ãƒâ€¦Ã‚Â¡ÃƒÆ’Ã†â€™ÃƒÂ¢Ã¢â€šÂ¬Ã…Â¡ÃƒÆ’Ã¢â‚¬Å¡Ãƒâ€šÃ‚Â¢ÃƒÆ’Ã†â€™Ãƒâ€ Ã¢â‚¬â„¢ÃƒÆ’Ã¢â‚¬Â ÃƒÂ¢Ã¢â€šÂ¬Ã¢â€žÂ¢ÃƒÆ’Ã†â€™ÃƒÂ¢Ã¢â€šÂ¬Ã…Â¡ÃƒÆ’Ã¢â‚¬Å¡Ãƒâ€šÃ‚Â¢ÃƒÆ’Ã†â€™Ãƒâ€ Ã¢â‚¬â„¢ÃƒÆ’Ã¢â‚¬Å¡Ãƒâ€šÃ‚Â¢ÃƒÆ’Ã†â€™Ãƒâ€šÃ‚Â¢ÃƒÆ’Ã‚Â¢ÃƒÂ¢Ã¢â‚¬Å¡Ã‚Â¬Ãƒâ€¦Ã‚Â¡ÃƒÆ’Ã¢â‚¬Å¡Ãƒâ€šÃ‚Â¬ÃƒÆ’Ã†â€™ÃƒÂ¢Ã¢â€šÂ¬Ã‚Â¦ÃƒÆ’Ã¢â‚¬Å¡Ãƒâ€šÃ‚Â¡ÃƒÆ’Ã†â€™Ãƒâ€ Ã¢â‚¬â„¢ÃƒÆ’Ã‚Â¢ÃƒÂ¢Ã¢â‚¬Å¡Ã‚Â¬Ãƒâ€¦Ã‚Â¡ÃƒÆ’Ã†â€™ÃƒÂ¢Ã¢â€šÂ¬Ã…Â¡ÃƒÆ’Ã¢â‚¬Å¡Ãƒâ€šÃ‚Â¬ÃƒÆ’Ã†â€™Ãƒâ€ Ã¢â‚¬â„¢ÃƒÆ’Ã¢â‚¬Â ÃƒÂ¢Ã¢â€šÂ¬Ã¢â€žÂ¢ÃƒÆ’Ã†â€™Ãƒâ€šÃ‚Â¢ÃƒÆ’Ã‚Â¢ÃƒÂ¢Ã¢â€šÂ¬Ã…Â¡Ãƒâ€šÃ‚Â¬ÃƒÆ’Ã¢â‚¬Å¡Ãƒâ€šÃ‚Â¦ÃƒÆ’Ã†â€™Ãƒâ€ Ã¢â‚¬â„¢ÃƒÆ’Ã‚Â¢ÃƒÂ¢Ã¢â‚¬Å¡Ã‚Â¬Ãƒâ€¦Ã‚Â¡ÃƒÆ’Ã†â€™ÃƒÂ¢Ã¢â€šÂ¬Ã…Â¡ÃƒÆ’Ã¢â‚¬Å¡Ãƒâ€šÃ‚Â¡ÃƒÆ’Ã†â€™Ãƒâ€ Ã¢â‚¬â„¢ÃƒÆ’Ã¢â‚¬Â ÃƒÂ¢Ã¢â€šÂ¬Ã¢â€žÂ¢ÃƒÆ’Ã†â€™ÃƒÂ¢Ã¢â€šÂ¬Ã‚Â ÃƒÆ’Ã‚Â¢ÃƒÂ¢Ã¢â‚¬Å¡Ã‚Â¬ÃƒÂ¢Ã¢â‚¬Å¾Ã‚Â¢ÃƒÆ’Ã†â€™Ãƒâ€ Ã¢â‚¬â„¢ÃƒÆ’Ã‚Â¢ÃƒÂ¢Ã¢â‚¬Å¡Ã‚Â¬Ãƒâ€šÃ‚Â ÃƒÆ’Ã†â€™Ãƒâ€šÃ‚Â¢ÃƒÆ’Ã‚Â¢ÃƒÂ¢Ã¢â€šÂ¬Ã…Â¡Ãƒâ€šÃ‚Â¬ÃƒÆ’Ã‚Â¢ÃƒÂ¢Ã¢â€šÂ¬Ã…Â¾Ãƒâ€šÃ‚Â¢ÃƒÆ’Ã†â€™Ãƒâ€ Ã¢â‚¬â„¢ÃƒÆ’Ã¢â‚¬Â ÃƒÂ¢Ã¢â€šÂ¬Ã¢â€žÂ¢ÃƒÆ’Ã†â€™ÃƒÂ¢Ã¢â€šÂ¬Ã…Â¡ÃƒÆ’Ã¢â‚¬Å¡Ãƒâ€šÃ‚Â¢ÃƒÆ’Ã†â€™Ãƒâ€ Ã¢â‚¬â„¢ÃƒÆ’Ã¢â‚¬Å¡Ãƒâ€šÃ‚Â¢ÃƒÆ’Ã†â€™Ãƒâ€šÃ‚Â¢ÃƒÆ’Ã‚Â¢ÃƒÂ¢Ã¢â€šÂ¬Ã…Â¡Ãƒâ€šÃ‚Â¬ÃƒÆ’Ã¢â‚¬Â¦Ãƒâ€šÃ‚Â¡ÃƒÆ’Ã†â€™ÃƒÂ¢Ã¢â€šÂ¬Ã…Â¡ÃƒÆ’Ã¢â‚¬Å¡Ãƒâ€šÃ‚Â¬ÃƒÆ’Ã†â€™Ãƒâ€ Ã¢â‚¬â„¢ÃƒÆ’Ã‚Â¢ÃƒÂ¢Ã¢â‚¬Å¡Ã‚Â¬Ãƒâ€šÃ‚Â¦ÃƒÆ’Ã†â€™ÃƒÂ¢Ã¢â€šÂ¬Ã…Â¡ÃƒÆ’Ã¢â‚¬Å¡Ãƒâ€šÃ‚Â¡ÃƒÆ’Ã†â€™Ãƒâ€ Ã¢â‚¬â„¢ÃƒÆ’Ã¢â‚¬Â ÃƒÂ¢Ã¢â€šÂ¬Ã¢â€žÂ¢ÃƒÆ’Ã†â€™ÃƒÂ¢Ã¢â€šÂ¬Ã‚Â ÃƒÆ’Ã‚Â¢ÃƒÂ¢Ã¢â‚¬Å¡Ã‚Â¬ÃƒÂ¢Ã¢â‚¬Å¾Ã‚Â¢ÃƒÆ’Ã†â€™Ãƒâ€ Ã¢â‚¬â„¢ÃƒÆ’Ã¢â‚¬Å¡Ãƒâ€šÃ‚Â¢ÃƒÆ’Ã†â€™Ãƒâ€šÃ‚Â¢ÃƒÆ’Ã‚Â¢ÃƒÂ¢Ã¢â‚¬Å¡Ã‚Â¬Ãƒâ€¦Ã‚Â¡ÃƒÆ’Ã¢â‚¬Å¡Ãƒâ€šÃ‚Â¬ÃƒÆ’Ã†â€™ÃƒÂ¢Ã¢â€šÂ¬Ã‚Â¦ÃƒÆ’Ã¢â‚¬Å¡Ãƒâ€šÃ‚Â¡ÃƒÆ’Ã†â€™Ãƒâ€ Ã¢â‚¬â„¢ÃƒÆ’Ã¢â‚¬Â ÃƒÂ¢Ã¢â€šÂ¬Ã¢â€žÂ¢ÃƒÆ’Ã†â€™Ãƒâ€šÃ‚Â¢ÃƒÆ’Ã‚Â¢ÃƒÂ¢Ã¢â€šÂ¬Ã…Â¡Ãƒâ€šÃ‚Â¬ÃƒÆ’Ã¢â‚¬Â¦Ãƒâ€šÃ‚Â¡ÃƒÆ’Ã†â€™Ãƒâ€ Ã¢â‚¬â„¢ÃƒÆ’Ã‚Â¢ÃƒÂ¢Ã¢â‚¬Å¡Ã‚Â¬Ãƒâ€¦Ã‚Â¡ÃƒÆ’Ã†â€™ÃƒÂ¢Ã¢â€šÂ¬Ã…Â¡ÃƒÆ’Ã¢â‚¬Å¡Ãƒâ€šÃ‚Â± SD)</w:t>
+              <w:t>pH (Mean ÃƒÆ’Ã†â€™Ãƒâ€ Ã¢â‚¬â„¢ÃƒÆ’Ã¢â‚¬Â ÃƒÂ¢Ã¢â€šÂ¬Ã¢â€žÂ¢ÃƒÆ’Ã†â€™ÃƒÂ¢Ã¢â€šÂ¬Ã‚Â ÃƒÆ’Ã‚Â¢ÃƒÂ¢Ã¢â‚¬Å¡Ã‚Â¬ÃƒÂ¢Ã¢â‚¬Å¾Ã‚Â¢ÃƒÆ’Ã†â€™Ãƒâ€ Ã¢â‚¬â„¢ÃƒÆ’Ã‚Â¢ÃƒÂ¢Ã¢â‚¬Å¡Ã‚Â¬Ãƒâ€šÃ‚Â ÃƒÆ’Ã†â€™Ãƒâ€šÃ‚Â¢ÃƒÆ’Ã‚Â¢ÃƒÂ¢Ã¢â€šÂ¬Ã…Â¡Ãƒâ€šÃ‚Â¬ÃƒÆ’Ã‚Â¢ÃƒÂ¢Ã¢â€šÂ¬Ã…Â¾Ãƒâ€šÃ‚Â¢ÃƒÆ’Ã†â€™Ãƒâ€ Ã¢â‚¬â„¢ÃƒÆ’Ã¢â‚¬Â ÃƒÂ¢Ã¢â€šÂ¬Ã¢â€žÂ¢ÃƒÆ’Ã†â€™Ãƒâ€šÃ‚Â¢ÃƒÆ’Ã‚Â¢ÃƒÂ¢Ã¢â€šÂ¬Ã…Â¡Ãƒâ€šÃ‚Â¬ÃƒÆ’Ã¢â‚¬Å¡Ãƒâ€šÃ‚Â ÃƒÆ’Ã†â€™Ãƒâ€ Ã¢â‚¬â„¢ÃƒÆ’Ã¢â‚¬Å¡Ãƒâ€šÃ‚Â¢ÃƒÆ’Ã†â€™Ãƒâ€šÃ‚Â¢ÃƒÆ’Ã‚Â¢ÃƒÂ¢Ã¢â‚¬Å¡Ã‚Â¬Ãƒâ€¦Ã‚Â¡ÃƒÆ’Ã¢â‚¬Å¡Ãƒâ€šÃ‚Â¬ÃƒÆ’Ã†â€™Ãƒâ€šÃ‚Â¢ÃƒÆ’Ã‚Â¢ÃƒÂ¢Ã¢â‚¬Å¡Ã‚Â¬Ãƒâ€¦Ã‚Â¾ÃƒÆ’Ã¢â‚¬Å¡Ãƒâ€šÃ‚Â¢ÃƒÆ’Ã†â€™Ãƒâ€ Ã¢â‚¬â„¢ÃƒÆ’Ã¢â‚¬Â ÃƒÂ¢Ã¢â€šÂ¬Ã¢â€žÂ¢ÃƒÆ’Ã†â€™ÃƒÂ¢Ã¢â€šÂ¬Ã‚Â ÃƒÆ’Ã‚Â¢ÃƒÂ¢Ã¢â‚¬Å¡Ã‚Â¬ÃƒÂ¢Ã¢â‚¬Å¾Ã‚Â¢ÃƒÆ’Ã†â€™Ãƒâ€ Ã¢â‚¬â„¢ÃƒÆ’Ã¢â‚¬Å¡Ãƒâ€šÃ‚Â¢ÃƒÆ’Ã†â€™Ãƒâ€šÃ‚Â¢ÃƒÆ’Ã‚Â¢ÃƒÂ¢Ã¢â‚¬Å¡Ã‚Â¬Ãƒâ€¦Ã‚Â¡ÃƒÆ’Ã¢â‚¬Å¡Ãƒâ€šÃ‚Â¬ÃƒÆ’Ã†â€™ÃƒÂ¢Ã¢â€šÂ¬Ã…Â¡ÃƒÆ’Ã¢â‚¬Å¡Ãƒâ€šÃ‚Â ÃƒÆ’Ã†â€™Ãƒâ€ Ã¢â‚¬â„¢ÃƒÆ’Ã¢â‚¬Â ÃƒÂ¢Ã¢â€šÂ¬Ã¢â€žÂ¢ÃƒÆ’Ã†â€™ÃƒÂ¢Ã¢â€šÂ¬Ã…Â¡ÃƒÆ’Ã¢â‚¬Å¡Ãƒâ€šÃ‚Â¢ÃƒÆ’Ã†â€™Ãƒâ€ Ã¢â‚¬â„¢ÃƒÆ’Ã¢â‚¬Å¡Ãƒâ€šÃ‚Â¢ÃƒÆ’Ã†â€™Ãƒâ€šÃ‚Â¢ÃƒÆ’Ã‚Â¢ÃƒÂ¢Ã¢â€šÂ¬Ã…Â¡Ãƒâ€šÃ‚Â¬ÃƒÆ’Ã¢â‚¬Â¦Ãƒâ€šÃ‚Â¡ÃƒÆ’Ã†â€™ÃƒÂ¢Ã¢â€šÂ¬Ã…Â¡ÃƒÆ’Ã¢â‚¬Å¡Ãƒâ€šÃ‚Â¬ÃƒÆ’Ã†â€™Ãƒâ€ Ã¢â‚¬â„¢ÃƒÆ’Ã¢â‚¬Å¡Ãƒâ€šÃ‚Â¢ÃƒÆ’Ã†â€™Ãƒâ€šÃ‚Â¢ÃƒÆ’Ã‚Â¢ÃƒÂ¢Ã¢â€šÂ¬Ã…Â¡Ãƒâ€šÃ‚Â¬ÃƒÆ’Ã¢â‚¬Â¦Ãƒâ€šÃ‚Â¾ÃƒÆ’Ã†â€™ÃƒÂ¢Ã¢â€šÂ¬Ã…Â¡ÃƒÆ’Ã¢â‚¬Å¡Ãƒâ€šÃ‚Â¢ÃƒÆ’Ã†â€™Ãƒâ€ Ã¢â‚¬â„¢ÃƒÆ’Ã¢â‚¬Â ÃƒÂ¢Ã¢â€šÂ¬Ã¢â€žÂ¢ÃƒÆ’Ã†â€™ÃƒÂ¢Ã¢â€šÂ¬Ã‚Â ÃƒÆ’Ã‚Â¢ÃƒÂ¢Ã¢â‚¬Å¡Ã‚Â¬ÃƒÂ¢Ã¢â‚¬Å¾Ã‚Â¢ÃƒÆ’Ã†â€™Ãƒâ€ Ã¢â‚¬â„¢ÃƒÆ’Ã‚Â¢ÃƒÂ¢Ã¢â‚¬Å¡Ã‚Â¬Ãƒâ€šÃ‚Â ÃƒÆ’Ã†â€™Ãƒâ€šÃ‚Â¢ÃƒÆ’Ã‚Â¢ÃƒÂ¢Ã¢â€šÂ¬Ã…Â¡Ãƒâ€šÃ‚Â¬ÃƒÆ’Ã‚Â¢ÃƒÂ¢Ã¢â€šÂ¬Ã…Â¾Ãƒâ€šÃ‚Â¢ÃƒÆ’Ã†â€™Ãƒâ€ Ã¢â‚¬â„¢ÃƒÆ’Ã¢â‚¬Â ÃƒÂ¢Ã¢â€šÂ¬Ã¢â€žÂ¢ÃƒÆ’Ã†â€™Ãƒâ€šÃ‚Â¢ÃƒÆ’Ã‚Â¢ÃƒÂ¢Ã¢â€šÂ¬Ã…Â¡Ãƒâ€šÃ‚Â¬ÃƒÆ’Ã¢â‚¬Â¦Ãƒâ€šÃ‚Â¡ÃƒÆ’Ã†â€™Ãƒâ€ Ã¢â‚¬â„¢ÃƒÆ’Ã‚Â¢ÃƒÂ¢Ã¢â‚¬Å¡Ã‚Â¬Ãƒâ€¦Ã‚Â¡ÃƒÆ’Ã†â€™ÃƒÂ¢Ã¢â€šÂ¬Ã…Â¡ÃƒÆ’Ã¢â‚¬Å¡Ãƒâ€šÃ‚Â¢ÃƒÆ’Ã†â€™Ãƒâ€ Ã¢â‚¬â„¢ÃƒÆ’Ã¢â‚¬Â ÃƒÂ¢Ã¢â€šÂ¬Ã¢â€žÂ¢ÃƒÆ’Ã†â€™ÃƒÂ¢Ã¢â€šÂ¬Ã‚Â ÃƒÆ’Ã‚Â¢ÃƒÂ¢Ã¢â‚¬Å¡Ã‚Â¬ÃƒÂ¢Ã¢â‚¬Å¾Ã‚Â¢ÃƒÆ’Ã†â€™Ãƒâ€ Ã¢â‚¬â„¢ÃƒÆ’Ã‚Â¢ÃƒÂ¢Ã¢â‚¬Å¡Ã‚Â¬Ãƒâ€¦Ã‚Â¡ÃƒÆ’Ã†â€™ÃƒÂ¢Ã¢â€šÂ¬Ã…Â¡ÃƒÆ’Ã¢â‚¬Å¡Ãƒâ€šÃ‚Â¢ÃƒÆ’Ã†â€™Ãƒâ€ Ã¢â‚¬â„¢ÃƒÆ’Ã¢â‚¬Â ÃƒÂ¢Ã¢â€šÂ¬Ã¢â€žÂ¢ÃƒÆ’Ã†â€™ÃƒÂ¢Ã¢â€šÂ¬Ã…Â¡ÃƒÆ’Ã¢â‚¬Å¡Ãƒâ€šÃ‚Â¢ÃƒÆ’Ã†â€™Ãƒâ€ Ã¢â‚¬â„¢ÃƒÆ’Ã¢â‚¬Å¡Ãƒâ€šÃ‚Â¢ÃƒÆ’Ã†â€™Ãƒâ€šÃ‚Â¢ÃƒÆ’Ã‚Â¢ÃƒÂ¢Ã¢â€šÂ¬Ã…Â¡Ãƒâ€šÃ‚Â¬ÃƒÆ’Ã¢â‚¬Â¦Ãƒâ€šÃ‚Â¡ÃƒÆ’Ã†â€™ÃƒÂ¢Ã¢â€šÂ¬Ã…Â¡ÃƒÆ’Ã¢â‚¬Å¡Ãƒâ€šÃ‚Â¬ÃƒÆ’Ã†â€™Ãƒâ€ Ã¢â‚¬â„¢ÃƒÆ’Ã‚Â¢ÃƒÂ¢Ã¢â‚¬Å¡Ã‚Â¬Ãƒâ€šÃ‚Â¦ÃƒÆ’Ã†â€™ÃƒÂ¢Ã¢â€šÂ¬Ã…Â¡ÃƒÆ’Ã¢â‚¬Å¡Ãƒâ€šÃ‚Â¡ÃƒÆ’Ã†â€™Ãƒâ€ Ã¢â‚¬â„¢ÃƒÆ’Ã¢â‚¬Â ÃƒÂ¢Ã¢â€šÂ¬Ã¢â€žÂ¢ÃƒÆ’Ã†â€™Ãƒâ€šÃ‚Â¢ÃƒÆ’Ã‚Â¢ÃƒÂ¢Ã¢â€šÂ¬Ã…Â¡Ãƒâ€šÃ‚Â¬ÃƒÆ’Ã¢â‚¬Â¦Ãƒâ€šÃ‚Â¡ÃƒÆ’Ã†â€™Ãƒâ€ Ã¢â‚¬â„¢ÃƒÆ’Ã‚Â¢ÃƒÂ¢Ã¢â‚¬Å¡Ã‚Â¬Ãƒâ€¦Ã‚Â¡ÃƒÆ’Ã†â€™ÃƒÂ¢Ã¢â€šÂ¬Ã…Â¡ÃƒÆ’Ã¢â‚¬Å¡Ãƒâ€šÃ‚Â¬ÃƒÆ’Ã†â€™Ãƒâ€ Ã¢â‚¬â„¢ÃƒÆ’Ã¢â‚¬Â ÃƒÂ¢Ã¢â€šÂ¬Ã¢â€žÂ¢ÃƒÆ’Ã†â€™ÃƒÂ¢Ã¢â€šÂ¬Ã‚Â ÃƒÆ’Ã‚Â¢ÃƒÂ¢Ã¢â‚¬Å¡Ã‚Â¬ÃƒÂ¢Ã¢â‚¬Å¾Ã‚Â¢ÃƒÆ’Ã†â€™Ãƒâ€ Ã¢â‚¬â„¢ÃƒÆ’Ã¢â‚¬Å¡Ãƒâ€šÃ‚Â¢ÃƒÆ’Ã†â€™Ãƒâ€šÃ‚Â¢ÃƒÆ’Ã‚Â¢ÃƒÂ¢Ã¢â‚¬Å¡Ã‚Â¬Ãƒâ€¦Ã‚Â¡ÃƒÆ’Ã¢â‚¬Å¡Ãƒâ€šÃ‚Â¬ÃƒÆ’Ã†â€™ÃƒÂ¢Ã¢â€šÂ¬Ã…Â¡ÃƒÆ’Ã¢â‚¬Å¡Ãƒâ€šÃ‚Â¦ÃƒÆ’Ã†â€™Ãƒâ€ Ã¢â‚¬â„¢ÃƒÆ’Ã¢â‚¬Â ÃƒÂ¢Ã¢â€šÂ¬Ã¢â€žÂ¢ÃƒÆ’Ã†â€™Ãƒâ€šÃ‚Â¢ÃƒÆ’Ã‚Â¢ÃƒÂ¢Ã¢â€šÂ¬Ã…Â¡Ãƒâ€šÃ‚Â¬ÃƒÆ’Ã¢â‚¬Â¦Ãƒâ€šÃ‚Â¡ÃƒÆ’Ã†â€™Ãƒâ€ Ã¢â‚¬â„¢ÃƒÆ’Ã‚Â¢ÃƒÂ¢Ã¢â‚¬Å¡Ã‚Â¬Ãƒâ€¦Ã‚Â¡ÃƒÆ’Ã†â€™ÃƒÂ¢Ã¢â€šÂ¬Ã…Â¡ÃƒÆ’Ã¢â‚¬Å¡Ãƒâ€šÃ‚Â¡ÃƒÆ’Ã†â€™Ãƒâ€ Ã¢â‚¬â„¢ÃƒÆ’Ã¢â‚¬Â ÃƒÂ¢Ã¢â€šÂ¬Ã¢â€žÂ¢ÃƒÆ’Ã†â€™ÃƒÂ¢Ã¢â€šÂ¬Ã‚Â ÃƒÆ’Ã‚Â¢ÃƒÂ¢Ã¢â‚¬Å¡Ã‚Â¬ÃƒÂ¢Ã¢â‚¬Å¾Ã‚Â¢ÃƒÆ’Ã†â€™Ãƒâ€ Ã¢â‚¬â„¢ÃƒÆ’Ã‚Â¢ÃƒÂ¢Ã¢â‚¬Å¡Ã‚Â¬Ãƒâ€šÃ‚Â ÃƒÆ’Ã†â€™Ãƒâ€šÃ‚Â¢ÃƒÆ’Ã‚Â¢ÃƒÂ¢Ã¢â€šÂ¬Ã…Â¡Ãƒâ€šÃ‚Â¬ÃƒÆ’Ã‚Â¢ÃƒÂ¢Ã¢â€šÂ¬Ã…Â¾Ãƒâ€šÃ‚Â¢ÃƒÆ’Ã†â€™Ãƒâ€ Ã¢â‚¬â„¢ÃƒÆ’Ã¢â‚¬Â ÃƒÂ¢Ã¢â€šÂ¬Ã¢â€žÂ¢ÃƒÆ’Ã†â€™Ãƒâ€šÃ‚Â¢ÃƒÆ’Ã‚Â¢ÃƒÂ¢Ã¢â€šÂ¬Ã…Â¡Ãƒâ€šÃ‚Â¬ÃƒÆ’Ã¢â‚¬Å¡Ãƒâ€šÃ‚Â ÃƒÆ’Ã†â€™Ãƒâ€ Ã¢â‚¬â„¢ÃƒÆ’Ã¢â‚¬Å¡Ãƒâ€šÃ‚Â¢ÃƒÆ’Ã†â€™Ãƒâ€šÃ‚Â¢ÃƒÆ’Ã‚Â¢ÃƒÂ¢Ã¢â‚¬Å¡Ã‚Â¬Ãƒâ€¦Ã‚Â¡ÃƒÆ’Ã¢â‚¬Å¡Ãƒâ€šÃ‚Â¬ÃƒÆ’Ã†â€™Ãƒâ€šÃ‚Â¢ÃƒÆ’Ã‚Â¢ÃƒÂ¢Ã¢â‚¬Å¡Ã‚Â¬Ãƒâ€¦Ã‚Â¾ÃƒÆ’Ã¢â‚¬Å¡Ãƒâ€šÃ‚Â¢ÃƒÆ’Ã†â€™Ãƒâ€ Ã¢â‚¬â„¢ÃƒÆ’Ã¢â‚¬Â ÃƒÂ¢Ã¢â€šÂ¬Ã¢â€žÂ¢ÃƒÆ’Ã†â€™ÃƒÂ¢Ã¢â€šÂ¬Ã‚Â ÃƒÆ’Ã‚Â¢ÃƒÂ¢Ã¢â‚¬Å¡Ã‚Â¬ÃƒÂ¢Ã¢â‚¬Å¾Ã‚Â¢ÃƒÆ’Ã†â€™Ãƒâ€ Ã¢â‚¬â„¢ÃƒÆ’Ã‚Â¢ÃƒÂ¢Ã¢â‚¬Å¡Ã‚Â¬Ãƒâ€¦Ã‚Â¡ÃƒÆ’Ã†â€™ÃƒÂ¢Ã¢â€šÂ¬Ã…Â¡ÃƒÆ’Ã¢â‚¬Å¡Ãƒâ€šÃ‚Â¢ÃƒÆ’Ã†â€™Ãƒâ€ Ã¢â‚¬â„¢ÃƒÆ’Ã¢â‚¬Â ÃƒÂ¢Ã¢â€šÂ¬Ã¢â€žÂ¢ÃƒÆ’Ã†â€™ÃƒÂ¢Ã¢â€šÂ¬Ã…Â¡ÃƒÆ’Ã¢â‚¬Å¡Ãƒâ€šÃ‚Â¢ÃƒÆ’Ã†â€™Ãƒâ€ Ã¢â‚¬â„¢ÃƒÆ’Ã¢â‚¬Å¡Ãƒâ€šÃ‚Â¢ÃƒÆ’Ã†â€™Ãƒâ€šÃ‚Â¢ÃƒÆ’Ã‚Â¢ÃƒÂ¢Ã¢â‚¬Å¡Ã‚Â¬Ãƒâ€¦Ã‚Â¡ÃƒÆ’Ã¢â‚¬Å¡Ãƒâ€šÃ‚Â¬ÃƒÆ’Ã†â€™ÃƒÂ¢Ã¢â€šÂ¬Ã‚Â¦ÃƒÆ’Ã¢â‚¬Å¡Ãƒâ€šÃ‚Â¡ÃƒÆ’Ã†â€™Ãƒâ€ Ã¢â‚¬â„¢ÃƒÆ’Ã‚Â¢ÃƒÂ¢Ã¢â‚¬Å¡Ã‚Â¬Ãƒâ€¦Ã‚Â¡ÃƒÆ’Ã†â€™ÃƒÂ¢Ã¢â€šÂ¬Ã…Â¡ÃƒÆ’Ã¢â‚¬Å¡Ãƒâ€šÃ‚Â¬ÃƒÆ’Ã†â€™Ãƒâ€ Ã¢â‚¬â„¢ÃƒÆ’Ã¢â‚¬Â ÃƒÂ¢Ã¢â€šÂ¬Ã¢â€žÂ¢ÃƒÆ’Ã†â€™Ãƒâ€šÃ‚Â¢ÃƒÆ’Ã‚Â¢ÃƒÂ¢Ã¢â€šÂ¬Ã…Â¡Ãƒâ€šÃ‚Â¬ÃƒÆ’Ã¢â‚¬Å¡Ãƒâ€šÃ‚Â¦ÃƒÆ’Ã†â€™Ãƒâ€ Ã¢â‚¬â„¢ÃƒÆ’Ã‚Â¢ÃƒÂ¢Ã¢â‚¬Å¡Ã‚Â¬Ãƒâ€¦Ã‚Â¡ÃƒÆ’Ã†â€™ÃƒÂ¢Ã¢â€šÂ¬Ã…Â¡ÃƒÆ’Ã¢â‚¬Å¡Ãƒâ€šÃ‚Â¡ÃƒÆ’Ã†â€™Ãƒâ€ Ã¢â‚¬â„¢ÃƒÆ’Ã¢â‚¬Â ÃƒÂ¢Ã¢â€šÂ¬Ã¢â€žÂ¢ÃƒÆ’Ã†â€™ÃƒÂ¢Ã¢â€šÂ¬Ã‚Â ÃƒÆ’Ã‚Â¢ÃƒÂ¢Ã¢â‚¬Å¡Ã‚Â¬ÃƒÂ¢Ã¢â‚¬Å¾Ã‚Â¢ÃƒÆ’Ã†â€™Ãƒâ€ Ã¢â‚¬â„¢ÃƒÆ’Ã‚Â¢ÃƒÂ¢Ã¢â‚¬Å¡Ã‚Â¬Ãƒâ€šÃ‚Â ÃƒÆ’Ã†â€™Ãƒâ€šÃ‚Â¢ÃƒÆ’Ã‚Â¢ÃƒÂ¢Ã¢â€šÂ¬Ã…Â¡Ãƒâ€šÃ‚Â¬ÃƒÆ’Ã‚Â¢ÃƒÂ¢Ã¢â€šÂ¬Ã…Â¾Ãƒâ€šÃ‚Â¢ÃƒÆ’Ã†â€™Ãƒâ€ Ã¢â‚¬â„¢ÃƒÆ’Ã¢â‚¬Â ÃƒÂ¢Ã¢â€šÂ¬Ã¢â€žÂ¢ÃƒÆ’Ã†â€™ÃƒÂ¢Ã¢â€šÂ¬Ã…Â¡ÃƒÆ’Ã¢â‚¬Å¡Ãƒâ€šÃ‚Â¢ÃƒÆ’Ã†â€™Ãƒâ€ Ã¢â‚¬â„¢ÃƒÆ’Ã¢â‚¬Å¡Ãƒâ€šÃ‚Â¢ÃƒÆ’Ã†â€™Ãƒâ€šÃ‚Â¢ÃƒÆ’Ã‚Â¢ÃƒÂ¢Ã¢â€šÂ¬Ã…Â¡Ãƒâ€šÃ‚Â¬ÃƒÆ’Ã¢â‚¬Â¦Ãƒâ€šÃ‚Â¡ÃƒÆ’Ã†â€™ÃƒÂ¢Ã¢â€šÂ¬Ã…Â¡ÃƒÆ’Ã¢â‚¬Å¡Ãƒâ€šÃ‚Â¬ÃƒÆ’Ã†â€™Ãƒâ€ Ã¢â‚¬â„¢ÃƒÆ’Ã‚Â¢ÃƒÂ¢Ã¢â‚¬Å¡Ã‚Â¬Ãƒâ€šÃ‚Â¦ÃƒÆ’Ã†â€™ÃƒÂ¢Ã¢â€šÂ¬Ã…Â¡ÃƒÆ’Ã¢â‚¬Å¡Ãƒâ€šÃ‚Â¡ÃƒÆ’Ã†â€™Ãƒâ€ Ã¢â‚¬â„¢ÃƒÆ’Ã¢â‚¬Â ÃƒÂ¢Ã¢â€šÂ¬Ã¢â€žÂ¢ÃƒÆ’Ã†â€™ÃƒÂ¢Ã¢â€šÂ¬Ã‚Â ÃƒÆ’Ã‚Â¢ÃƒÂ¢Ã¢â‚¬Å¡Ã‚Â¬ÃƒÂ¢Ã¢â‚¬Å¾Ã‚Â¢ÃƒÆ’Ã†â€™Ãƒâ€ Ã¢â‚¬â„¢ÃƒÆ’Ã¢â‚¬Å¡Ãƒâ€šÃ‚Â¢ÃƒÆ’Ã†â€™Ãƒâ€šÃ‚Â¢ÃƒÆ’Ã‚Â¢ÃƒÂ¢Ã¢â‚¬Å¡Ã‚Â¬Ãƒâ€¦Ã‚Â¡ÃƒÆ’Ã¢â‚¬Å¡Ãƒâ€šÃ‚Â¬ÃƒÆ’Ã†â€™ÃƒÂ¢Ã¢â€šÂ¬Ã‚Â¦ÃƒÆ’Ã¢â‚¬Å¡Ãƒâ€šÃ‚Â¡ÃƒÆ’Ã†â€™Ãƒâ€ Ã¢â‚¬â„¢ÃƒÆ’Ã¢â‚¬Â ÃƒÂ¢Ã¢â€šÂ¬Ã¢â€žÂ¢ÃƒÆ’Ã†â€™Ãƒâ€šÃ‚Â¢ÃƒÆ’Ã‚Â¢ÃƒÂ¢Ã¢â€šÂ¬Ã…Â¡Ãƒâ€šÃ‚Â¬ÃƒÆ’Ã¢â‚¬Â¦Ãƒâ€šÃ‚Â¡ÃƒÆ’Ã†â€™Ãƒâ€ Ã¢â‚¬â„¢ÃƒÆ’Ã‚Â¢ÃƒÂ¢Ã¢â‚¬Å¡Ã‚Â¬Ãƒâ€¦Ã‚Â¡ÃƒÆ’Ã†â€™ÃƒÂ¢Ã¢â€šÂ¬Ã…Â¡ÃƒÆ’Ã¢â‚¬Å¡Ãƒâ€šÃ‚Â± SD)</w:t>
             </w:r>
           </w:p>
         </w:tc>
@@ -7075,7 +7075,7 @@
               <w:rPr>
                 <w:rFonts w:ascii="Times New Roman" w:hAnsi="Times New Roman" w:cs="Times New Roman"/>
               </w:rPr>
-              <w:t>Temperature (ÃƒÆ’Ã†â€™Ãƒâ€ Ã¢â‚¬â„¢ÃƒÆ’Ã¢â‚¬Â ÃƒÂ¢Ã¢â€šÂ¬Ã¢â€žÂ¢ÃƒÆ’Ã†â€™ÃƒÂ¢Ã¢â€šÂ¬Ã‚Â ÃƒÆ’Ã‚Â¢ÃƒÂ¢Ã¢â‚¬Å¡Ã‚Â¬ÃƒÂ¢Ã¢â‚¬Å¾Ã‚Â¢ÃƒÆ’Ã†â€™Ãƒâ€ Ã¢â‚¬â„¢ÃƒÆ’Ã‚Â¢ÃƒÂ¢Ã¢â‚¬Å¡Ã‚Â¬Ãƒâ€šÃ‚Â ÃƒÆ’Ã†â€™Ãƒâ€šÃ‚Â¢ÃƒÆ’Ã‚Â¢ÃƒÂ¢Ã¢â€šÂ¬Ã…Â¡Ãƒâ€šÃ‚Â¬ÃƒÆ’Ã‚Â¢ÃƒÂ¢Ã¢â€šÂ¬Ã…Â¾Ãƒâ€šÃ‚Â¢ÃƒÆ’Ã†â€™Ãƒâ€ Ã¢â‚¬â„¢ÃƒÆ’Ã¢â‚¬Â ÃƒÂ¢Ã¢â€šÂ¬Ã¢â€žÂ¢ÃƒÆ’Ã†â€™Ãƒâ€šÃ‚Â¢ÃƒÆ’Ã‚Â¢ÃƒÂ¢Ã¢â€šÂ¬Ã…Â¡Ãƒâ€šÃ‚Â¬ÃƒÆ’Ã¢â‚¬Å¡Ãƒâ€šÃ‚Â ÃƒÆ’Ã†â€™Ãƒâ€ Ã¢â‚¬â„¢ÃƒÆ’Ã¢â‚¬Å¡Ãƒâ€šÃ‚Â¢ÃƒÆ’Ã†â€™Ãƒâ€šÃ‚Â¢ÃƒÆ’Ã‚Â¢ÃƒÂ¢Ã¢â‚¬Å¡Ã‚Â¬Ãƒâ€¦Ã‚Â¡ÃƒÆ’Ã¢â‚¬Å¡Ãƒâ€šÃ‚Â¬ÃƒÆ’Ã†â€™Ãƒâ€šÃ‚Â¢ÃƒÆ’Ã‚Â¢ÃƒÂ¢Ã¢â‚¬Å¡Ã‚Â¬Ãƒâ€¦Ã‚Â¾ÃƒÆ’Ã¢â‚¬Å¡Ãƒâ€šÃ‚Â¢ÃƒÆ’Ã†â€™Ãƒâ€ Ã¢â‚¬â„¢ÃƒÆ’Ã¢â‚¬Â ÃƒÂ¢Ã¢â€šÂ¬Ã¢â€žÂ¢ÃƒÆ’Ã†â€™ÃƒÂ¢Ã¢â€šÂ¬Ã‚Â ÃƒÆ’Ã‚Â¢ÃƒÂ¢Ã¢â‚¬Å¡Ã‚Â¬ÃƒÂ¢Ã¢â‚¬Å¾Ã‚Â¢ÃƒÆ’Ã†â€™Ãƒâ€ Ã¢â‚¬â„¢ÃƒÆ’Ã‚Â¢ÃƒÂ¢Ã¢â‚¬Å¡Ã‚Â¬Ãƒâ€¦Ã‚Â¡ÃƒÆ’Ã†â€™ÃƒÂ¢Ã¢â€šÂ¬Ã…Â¡ÃƒÆ’Ã¢â‚¬Å¡Ãƒâ€šÃ‚Â¢ÃƒÆ’Ã†â€™Ãƒâ€ Ã¢â‚¬â„¢ÃƒÆ’Ã¢â‚¬Â ÃƒÂ¢Ã¢â€šÂ¬Ã¢â€žÂ¢ÃƒÆ’Ã†â€™ÃƒÂ¢Ã¢â€šÂ¬Ã…Â¡ÃƒÆ’Ã¢â‚¬Å¡Ãƒâ€šÃ‚Â¢ÃƒÆ’Ã†â€™Ãƒâ€ Ã¢â‚¬â„¢ÃƒÆ’Ã¢â‚¬Å¡Ãƒâ€šÃ‚Â¢ÃƒÆ’Ã†â€™Ãƒâ€šÃ‚Â¢ÃƒÆ’Ã‚Â¢ÃƒÂ¢Ã¢â‚¬Å¡Ã‚Â¬Ãƒâ€¦Ã‚Â¡ÃƒÆ’Ã¢â‚¬Å¡Ãƒâ€šÃ‚Â¬ÃƒÆ’Ã†â€™ÃƒÂ¢Ã¢â€šÂ¬Ã‚Â¦ÃƒÆ’Ã¢â‚¬Å¡Ãƒâ€šÃ‚Â¡ÃƒÆ’Ã†â€™Ãƒâ€ Ã¢â‚¬â„¢ÃƒÆ’Ã‚Â¢ÃƒÂ¢Ã¢â‚¬Å¡Ã‚Â¬Ãƒâ€¦Ã‚Â¡ÃƒÆ’Ã†â€™ÃƒÂ¢Ã¢â€šÂ¬Ã…Â¡ÃƒÆ’Ã¢â‚¬Å¡Ãƒâ€šÃ‚Â¬ÃƒÆ’Ã†â€™Ãƒâ€ Ã¢â‚¬â„¢ÃƒÆ’Ã¢â‚¬Â ÃƒÂ¢Ã¢â€šÂ¬Ã¢â€žÂ¢ÃƒÆ’Ã†â€™Ãƒâ€šÃ‚Â¢ÃƒÆ’Ã‚Â¢ÃƒÂ¢Ã¢â€šÂ¬Ã…Â¡Ãƒâ€šÃ‚Â¬ÃƒÆ’Ã¢â‚¬Å¡Ãƒâ€šÃ‚Â¦ÃƒÆ’Ã†â€™Ãƒâ€ Ã¢â‚¬â„¢ÃƒÆ’Ã‚Â¢ÃƒÂ¢Ã¢â‚¬Å¡Ã‚Â¬Ãƒâ€¦Ã‚Â¡ÃƒÆ’Ã†â€™ÃƒÂ¢Ã¢â€šÂ¬Ã…Â¡ÃƒÆ’Ã¢â‚¬Å¡Ãƒâ€šÃ‚Â¡ÃƒÆ’Ã†â€™Ãƒâ€ Ã¢â‚¬â„¢ÃƒÆ’Ã¢â‚¬Â ÃƒÂ¢Ã¢â€šÂ¬Ã¢â€žÂ¢ÃƒÆ’Ã†â€™ÃƒÂ¢Ã¢â€šÂ¬Ã‚Â ÃƒÆ’Ã‚Â¢ÃƒÂ¢Ã¢â‚¬Å¡Ã‚Â¬ÃƒÂ¢Ã¢â‚¬Å¾Ã‚Â¢ÃƒÆ’Ã†â€™Ãƒâ€ Ã¢â‚¬â„¢ÃƒÆ’Ã‚Â¢ÃƒÂ¢Ã¢â‚¬Å¡Ã‚Â¬Ãƒâ€šÃ‚Â ÃƒÆ’Ã†â€™Ãƒâ€šÃ‚Â¢ÃƒÆ’Ã‚Â¢ÃƒÂ¢Ã¢â€šÂ¬Ã…Â¡Ãƒâ€šÃ‚Â¬ÃƒÆ’Ã‚Â¢ÃƒÂ¢Ã¢â€šÂ¬Ã…Â¾Ãƒâ€šÃ‚Â¢ÃƒÆ’Ã†â€™Ãƒâ€ Ã¢â‚¬â„¢ÃƒÆ’Ã¢â‚¬Â ÃƒÂ¢Ã¢â€šÂ¬Ã¢â€žÂ¢ÃƒÆ’Ã†â€™ÃƒÂ¢Ã¢â€šÂ¬Ã…Â¡ÃƒÆ’Ã¢â‚¬Å¡Ãƒâ€šÃ‚Â¢ÃƒÆ’Ã†â€™Ãƒâ€ Ã¢â‚¬â„¢ÃƒÆ’Ã¢â‚¬Å¡Ãƒâ€šÃ‚Â¢ÃƒÆ’Ã†â€™Ãƒâ€šÃ‚Â¢ÃƒÆ’Ã‚Â¢ÃƒÂ¢Ã¢â€šÂ¬Ã…Â¡Ãƒâ€šÃ‚Â¬ÃƒÆ’Ã¢â‚¬Â¦Ãƒâ€šÃ‚Â¡ÃƒÆ’Ã†â€™ÃƒÂ¢Ã¢â€šÂ¬Ã…Â¡ÃƒÆ’Ã¢â‚¬Å¡Ãƒâ€šÃ‚Â¬ÃƒÆ’Ã†â€™Ãƒâ€ Ã¢â‚¬â„¢ÃƒÆ’Ã‚Â¢ÃƒÂ¢Ã¢â‚¬Å¡Ã‚Â¬Ãƒâ€šÃ‚Â¦ÃƒÆ’Ã†â€™ÃƒÂ¢Ã¢â€šÂ¬Ã…Â¡ÃƒÆ’Ã¢â‚¬Å¡Ãƒâ€šÃ‚Â¡ÃƒÆ’Ã†â€™Ãƒâ€ Ã¢â‚¬â„¢ÃƒÆ’Ã¢â‚¬Â ÃƒÂ¢Ã¢â€šÂ¬Ã¢â€žÂ¢ÃƒÆ’Ã†â€™ÃƒÂ¢Ã¢â€šÂ¬Ã‚Â ÃƒÆ’Ã‚Â¢ÃƒÂ¢Ã¢â‚¬Å¡Ã‚Â¬ÃƒÂ¢Ã¢â‚¬Å¾Ã‚Â¢ÃƒÆ’Ã†â€™Ãƒâ€ Ã¢â‚¬â„¢ÃƒÆ’Ã¢â‚¬Å¡Ãƒâ€šÃ‚Â¢ÃƒÆ’Ã†â€™Ãƒâ€šÃ‚Â¢ÃƒÆ’Ã‚Â¢ÃƒÂ¢Ã¢â‚¬Å¡Ã‚Â¬Ãƒâ€¦Ã‚Â¡ÃƒÆ’Ã¢â‚¬Å¡Ãƒâ€šÃ‚Â¬ÃƒÆ’Ã†â€™ÃƒÂ¢Ã¢â€šÂ¬Ã‚Â¦ÃƒÆ’Ã¢â‚¬Å¡Ãƒâ€šÃ‚Â¡ÃƒÆ’Ã†â€™Ãƒâ€ Ã¢â‚¬â„¢ÃƒÆ’Ã¢â‚¬Â ÃƒÂ¢Ã¢â€šÂ¬Ã¢â€žÂ¢ÃƒÆ’Ã†â€™Ãƒâ€šÃ‚Â¢ÃƒÆ’Ã‚Â¢ÃƒÂ¢Ã¢â€šÂ¬Ã…Â¡Ãƒâ€šÃ‚Â¬ÃƒÆ’Ã¢â‚¬Â¦Ãƒâ€šÃ‚Â¡ÃƒÆ’Ã†â€™Ãƒâ€ Ã¢â‚¬â„¢ÃƒÆ’Ã‚Â¢ÃƒÂ¢Ã¢â‚¬Å¡Ã‚Â¬Ãƒâ€¦Ã‚Â¡ÃƒÆ’Ã†â€™ÃƒÂ¢Ã¢â€šÂ¬Ã…Â¡ÃƒÆ’Ã¢â‚¬Å¡Ãƒâ€šÃ‚Â°C)</w:t>
+              <w:t>Temperature (ÃƒÆ’Ã†â€™Ãƒâ€ Ã¢â‚¬â„¢ÃƒÆ’Ã¢â‚¬Â ÃƒÂ¢Ã¢â€šÂ¬Ã¢â€žÂ¢ÃƒÆ’Ã†â€™ÃƒÂ¢Ã¢â€šÂ¬Ã‚Â ÃƒÆ’Ã‚Â¢ÃƒÂ¢Ã¢â‚¬Å¡Ã‚Â¬ÃƒÂ¢Ã¢â‚¬Å¾Ã‚Â¢ÃƒÆ’Ã†â€™Ãƒâ€ Ã¢â‚¬â„¢ÃƒÆ’Ã‚Â¢ÃƒÂ¢Ã¢â‚¬Å¡Ã‚Â¬Ãƒâ€šÃ‚Â ÃƒÆ’Ã†â€™Ãƒâ€šÃ‚Â¢ÃƒÆ’Ã‚Â¢ÃƒÂ¢Ã¢â€šÂ¬Ã…Â¡Ãƒâ€šÃ‚Â¬ÃƒÆ’Ã‚Â¢ÃƒÂ¢Ã¢â€šÂ¬Ã…Â¾Ãƒâ€šÃ‚Â¢ÃƒÆ’Ã†â€™Ãƒâ€ Ã¢â‚¬â„¢ÃƒÆ’Ã¢â‚¬Â ÃƒÂ¢Ã¢â€šÂ¬Ã¢â€žÂ¢ÃƒÆ’Ã†â€™Ãƒâ€šÃ‚Â¢ÃƒÆ’Ã‚Â¢ÃƒÂ¢Ã¢â€šÂ¬Ã…Â¡Ãƒâ€šÃ‚Â¬ÃƒÆ’Ã¢â‚¬Å¡Ãƒâ€šÃ‚Â ÃƒÆ’Ã†â€™Ãƒâ€ Ã¢â‚¬â„¢ÃƒÆ’Ã¢â‚¬Å¡Ãƒâ€šÃ‚Â¢ÃƒÆ’Ã†â€™Ãƒâ€šÃ‚Â¢ÃƒÆ’Ã‚Â¢ÃƒÂ¢Ã¢â‚¬Å¡Ã‚Â¬Ãƒâ€¦Ã‚Â¡ÃƒÆ’Ã¢â‚¬Å¡Ãƒâ€šÃ‚Â¬ÃƒÆ’Ã†â€™Ãƒâ€šÃ‚Â¢ÃƒÆ’Ã‚Â¢ÃƒÂ¢Ã¢â‚¬Å¡Ã‚Â¬Ãƒâ€¦Ã‚Â¾ÃƒÆ’Ã¢â‚¬Å¡Ãƒâ€šÃ‚Â¢ÃƒÆ’Ã†â€™Ãƒâ€ Ã¢â‚¬â„¢ÃƒÆ’Ã¢â‚¬Â ÃƒÂ¢Ã¢â€šÂ¬Ã¢â€žÂ¢ÃƒÆ’Ã†â€™ÃƒÂ¢Ã¢â€šÂ¬Ã‚Â ÃƒÆ’Ã‚Â¢ÃƒÂ¢Ã¢â‚¬Å¡Ã‚Â¬ÃƒÂ¢Ã¢â‚¬Å¾Ã‚Â¢ÃƒÆ’Ã†â€™Ãƒâ€ Ã¢â‚¬â„¢ÃƒÆ’Ã¢â‚¬Å¡Ãƒâ€šÃ‚Â¢ÃƒÆ’Ã†â€™Ãƒâ€šÃ‚Â¢ÃƒÆ’Ã‚Â¢ÃƒÂ¢Ã¢â‚¬Å¡Ã‚Â¬Ãƒâ€¦Ã‚Â¡ÃƒÆ’Ã¢â‚¬Å¡Ãƒâ€šÃ‚Â¬ÃƒÆ’Ã†â€™ÃƒÂ¢Ã¢â€šÂ¬Ã…Â¡ÃƒÆ’Ã¢â‚¬Å¡Ãƒâ€šÃ‚Â ÃƒÆ’Ã†â€™Ãƒâ€ Ã¢â‚¬â„¢ÃƒÆ’Ã¢â‚¬Â ÃƒÂ¢Ã¢â€šÂ¬Ã¢â€žÂ¢ÃƒÆ’Ã†â€™ÃƒÂ¢Ã¢â€šÂ¬Ã…Â¡ÃƒÆ’Ã¢â‚¬Å¡Ãƒâ€šÃ‚Â¢ÃƒÆ’Ã†â€™Ãƒâ€ Ã¢â‚¬â„¢ÃƒÆ’Ã¢â‚¬Å¡Ãƒâ€šÃ‚Â¢ÃƒÆ’Ã†â€™Ãƒâ€šÃ‚Â¢ÃƒÆ’Ã‚Â¢ÃƒÂ¢Ã¢â€šÂ¬Ã…Â¡Ãƒâ€šÃ‚Â¬ÃƒÆ’Ã¢â‚¬Â¦Ãƒâ€šÃ‚Â¡ÃƒÆ’Ã†â€™ÃƒÂ¢Ã¢â€šÂ¬Ã…Â¡ÃƒÆ’Ã¢â‚¬Å¡Ãƒâ€šÃ‚Â¬ÃƒÆ’Ã†â€™Ãƒâ€ Ã¢â‚¬â„¢ÃƒÆ’Ã¢â‚¬Å¡Ãƒâ€šÃ‚Â¢ÃƒÆ’Ã†â€™Ãƒâ€šÃ‚Â¢ÃƒÆ’Ã‚Â¢ÃƒÂ¢Ã¢â€šÂ¬Ã…Â¡Ãƒâ€šÃ‚Â¬ÃƒÆ’Ã¢â‚¬Â¦Ãƒâ€šÃ‚Â¾ÃƒÆ’Ã†â€™ÃƒÂ¢Ã¢â€šÂ¬Ã…Â¡ÃƒÆ’Ã¢â‚¬Å¡Ãƒâ€šÃ‚Â¢ÃƒÆ’Ã†â€™Ãƒâ€ Ã¢â‚¬â„¢ÃƒÆ’Ã¢â‚¬Â ÃƒÂ¢Ã¢â€šÂ¬Ã¢â€žÂ¢ÃƒÆ’Ã†â€™ÃƒÂ¢Ã¢â€šÂ¬Ã‚Â ÃƒÆ’Ã‚Â¢ÃƒÂ¢Ã¢â‚¬Å¡Ã‚Â¬ÃƒÂ¢Ã¢â‚¬Å¾Ã‚Â¢ÃƒÆ’Ã†â€™Ãƒâ€ Ã¢â‚¬â„¢ÃƒÆ’Ã‚Â¢ÃƒÂ¢Ã¢â‚¬Å¡Ã‚Â¬Ãƒâ€šÃ‚Â ÃƒÆ’Ã†â€™Ãƒâ€šÃ‚Â¢ÃƒÆ’Ã‚Â¢ÃƒÂ¢Ã¢â€šÂ¬Ã…Â¡Ãƒâ€šÃ‚Â¬ÃƒÆ’Ã‚Â¢ÃƒÂ¢Ã¢â€šÂ¬Ã…Â¾Ãƒâ€šÃ‚Â¢ÃƒÆ’Ã†â€™Ãƒâ€ Ã¢â‚¬â„¢ÃƒÆ’Ã¢â‚¬Â ÃƒÂ¢Ã¢â€šÂ¬Ã¢â€žÂ¢ÃƒÆ’Ã†â€™Ãƒâ€šÃ‚Â¢ÃƒÆ’Ã‚Â¢ÃƒÂ¢Ã¢â€šÂ¬Ã…Â¡Ãƒâ€šÃ‚Â¬ÃƒÆ’Ã¢â‚¬Â¦Ãƒâ€šÃ‚Â¡ÃƒÆ’Ã†â€™Ãƒâ€ Ã¢â‚¬â„¢ÃƒÆ’Ã‚Â¢ÃƒÂ¢Ã¢â‚¬Å¡Ã‚Â¬Ãƒâ€¦Ã‚Â¡ÃƒÆ’Ã†â€™ÃƒÂ¢Ã¢â€šÂ¬Ã…Â¡ÃƒÆ’Ã¢â‚¬Å¡Ãƒâ€šÃ‚Â¢ÃƒÆ’Ã†â€™Ãƒâ€ Ã¢â‚¬â„¢ÃƒÆ’Ã¢â‚¬Â ÃƒÂ¢Ã¢â€šÂ¬Ã¢â€žÂ¢ÃƒÆ’Ã†â€™ÃƒÂ¢Ã¢â€šÂ¬Ã‚Â ÃƒÆ’Ã‚Â¢ÃƒÂ¢Ã¢â‚¬Å¡Ã‚Â¬ÃƒÂ¢Ã¢â‚¬Å¾Ã‚Â¢ÃƒÆ’Ã†â€™Ãƒâ€ Ã¢â‚¬â„¢ÃƒÆ’Ã‚Â¢ÃƒÂ¢Ã¢â‚¬Å¡Ã‚Â¬Ãƒâ€¦Ã‚Â¡ÃƒÆ’Ã†â€™ÃƒÂ¢Ã¢â€šÂ¬Ã…Â¡ÃƒÆ’Ã¢â‚¬Å¡Ãƒâ€šÃ‚Â¢ÃƒÆ’Ã†â€™Ãƒâ€ Ã¢â‚¬â„¢ÃƒÆ’Ã¢â‚¬Â ÃƒÂ¢Ã¢â€šÂ¬Ã¢â€žÂ¢ÃƒÆ’Ã†â€™ÃƒÂ¢Ã¢â€šÂ¬Ã…Â¡ÃƒÆ’Ã¢â‚¬Å¡Ãƒâ€šÃ‚Â¢ÃƒÆ’Ã†â€™Ãƒâ€ Ã¢â‚¬â„¢ÃƒÆ’Ã¢â‚¬Å¡Ãƒâ€šÃ‚Â¢ÃƒÆ’Ã†â€™Ãƒâ€šÃ‚Â¢ÃƒÆ’Ã‚Â¢ÃƒÂ¢Ã¢â€šÂ¬Ã…Â¡Ãƒâ€šÃ‚Â¬ÃƒÆ’Ã¢â‚¬Â¦Ãƒâ€šÃ‚Â¡ÃƒÆ’Ã†â€™ÃƒÂ¢Ã¢â€šÂ¬Ã…Â¡ÃƒÆ’Ã¢â‚¬Å¡Ãƒâ€šÃ‚Â¬ÃƒÆ’Ã†â€™Ãƒâ€ Ã¢â‚¬â„¢ÃƒÆ’Ã‚Â¢ÃƒÂ¢Ã¢â‚¬Å¡Ã‚Â¬Ãƒâ€šÃ‚Â¦ÃƒÆ’Ã†â€™ÃƒÂ¢Ã¢â€šÂ¬Ã…Â¡ÃƒÆ’Ã¢â‚¬Å¡Ãƒâ€šÃ‚Â¡ÃƒÆ’Ã†â€™Ãƒâ€ Ã¢â‚¬â„¢ÃƒÆ’Ã¢â‚¬Â ÃƒÂ¢Ã¢â€šÂ¬Ã¢â€žÂ¢ÃƒÆ’Ã†â€™Ãƒâ€šÃ‚Â¢ÃƒÆ’Ã‚Â¢ÃƒÂ¢Ã¢â€šÂ¬Ã…Â¡Ãƒâ€šÃ‚Â¬ÃƒÆ’Ã¢â‚¬Â¦Ãƒâ€šÃ‚Â¡ÃƒÆ’Ã†â€™Ãƒâ€ Ã¢â‚¬â„¢ÃƒÆ’Ã‚Â¢ÃƒÂ¢Ã¢â‚¬Å¡Ã‚Â¬Ãƒâ€¦Ã‚Â¡ÃƒÆ’Ã†â€™ÃƒÂ¢Ã¢â€šÂ¬Ã…Â¡ÃƒÆ’Ã¢â‚¬Å¡Ãƒâ€šÃ‚Â¬ÃƒÆ’Ã†â€™Ãƒâ€ Ã¢â‚¬â„¢ÃƒÆ’Ã¢â‚¬Â ÃƒÂ¢Ã¢â€šÂ¬Ã¢â€žÂ¢ÃƒÆ’Ã†â€™ÃƒÂ¢Ã¢â€šÂ¬Ã‚Â ÃƒÆ’Ã‚Â¢ÃƒÂ¢Ã¢â‚¬Å¡Ã‚Â¬ÃƒÂ¢Ã¢â‚¬Å¾Ã‚Â¢ÃƒÆ’Ã†â€™Ãƒâ€ Ã¢â‚¬â„¢ÃƒÆ’Ã¢â‚¬Å¡Ãƒâ€šÃ‚Â¢ÃƒÆ’Ã†â€™Ãƒâ€šÃ‚Â¢ÃƒÆ’Ã‚Â¢ÃƒÂ¢Ã¢â‚¬Å¡Ã‚Â¬Ãƒâ€¦Ã‚Â¡ÃƒÆ’Ã¢â‚¬Å¡Ãƒâ€šÃ‚Â¬ÃƒÆ’Ã†â€™ÃƒÂ¢Ã¢â€šÂ¬Ã…Â¡ÃƒÆ’Ã¢â‚¬Å¡Ãƒâ€šÃ‚Â¦ÃƒÆ’Ã†â€™Ãƒâ€ Ã¢â‚¬â„¢ÃƒÆ’Ã¢â‚¬Â ÃƒÂ¢Ã¢â€šÂ¬Ã¢â€žÂ¢ÃƒÆ’Ã†â€™Ãƒâ€šÃ‚Â¢ÃƒÆ’Ã‚Â¢ÃƒÂ¢Ã¢â€šÂ¬Ã…Â¡Ãƒâ€šÃ‚Â¬ÃƒÆ’Ã¢â‚¬Â¦Ãƒâ€šÃ‚Â¡ÃƒÆ’Ã†â€™Ãƒâ€ Ã¢â‚¬â„¢ÃƒÆ’Ã‚Â¢ÃƒÂ¢Ã¢â‚¬Å¡Ã‚Â¬Ãƒâ€¦Ã‚Â¡ÃƒÆ’Ã†â€™ÃƒÂ¢Ã¢â€šÂ¬Ã…Â¡ÃƒÆ’Ã¢â‚¬Å¡Ãƒâ€šÃ‚Â¡ÃƒÆ’Ã†â€™Ãƒâ€ Ã¢â‚¬â„¢ÃƒÆ’Ã¢â‚¬Â ÃƒÂ¢Ã¢â€šÂ¬Ã¢â€žÂ¢ÃƒÆ’Ã†â€™ÃƒÂ¢Ã¢â€šÂ¬Ã‚Â ÃƒÆ’Ã‚Â¢ÃƒÂ¢Ã¢â‚¬Å¡Ã‚Â¬ÃƒÂ¢Ã¢â‚¬Å¾Ã‚Â¢ÃƒÆ’Ã†â€™Ãƒâ€ Ã¢â‚¬â„¢ÃƒÆ’Ã‚Â¢ÃƒÂ¢Ã¢â‚¬Å¡Ã‚Â¬Ãƒâ€šÃ‚Â ÃƒÆ’Ã†â€™Ãƒâ€šÃ‚Â¢ÃƒÆ’Ã‚Â¢ÃƒÂ¢Ã¢â€šÂ¬Ã…Â¡Ãƒâ€šÃ‚Â¬ÃƒÆ’Ã‚Â¢ÃƒÂ¢Ã¢â€šÂ¬Ã…Â¾Ãƒâ€šÃ‚Â¢ÃƒÆ’Ã†â€™Ãƒâ€ Ã¢â‚¬â„¢ÃƒÆ’Ã¢â‚¬Â ÃƒÂ¢Ã¢â€šÂ¬Ã¢â€žÂ¢ÃƒÆ’Ã†â€™Ãƒâ€šÃ‚Â¢ÃƒÆ’Ã‚Â¢ÃƒÂ¢Ã¢â€šÂ¬Ã…Â¡Ãƒâ€šÃ‚Â¬ÃƒÆ’Ã¢â‚¬Å¡Ãƒâ€šÃ‚Â ÃƒÆ’Ã†â€™Ãƒâ€ Ã¢â‚¬â„¢ÃƒÆ’Ã¢â‚¬Å¡Ãƒâ€šÃ‚Â¢ÃƒÆ’Ã†â€™Ãƒâ€šÃ‚Â¢ÃƒÆ’Ã‚Â¢ÃƒÂ¢Ã¢â‚¬Å¡Ã‚Â¬Ãƒâ€¦Ã‚Â¡ÃƒÆ’Ã¢â‚¬Å¡Ãƒâ€šÃ‚Â¬ÃƒÆ’Ã†â€™Ãƒâ€šÃ‚Â¢ÃƒÆ’Ã‚Â¢ÃƒÂ¢Ã¢â‚¬Å¡Ã‚Â¬Ãƒâ€¦Ã‚Â¾ÃƒÆ’Ã¢â‚¬Å¡Ãƒâ€šÃ‚Â¢ÃƒÆ’Ã†â€™Ãƒâ€ Ã¢â‚¬â„¢ÃƒÆ’Ã¢â‚¬Â ÃƒÂ¢Ã¢â€šÂ¬Ã¢â€žÂ¢ÃƒÆ’Ã†â€™ÃƒÂ¢Ã¢â€šÂ¬Ã‚Â ÃƒÆ’Ã‚Â¢ÃƒÂ¢Ã¢â‚¬Å¡Ã‚Â¬ÃƒÂ¢Ã¢â‚¬Å¾Ã‚Â¢ÃƒÆ’Ã†â€™Ãƒâ€ Ã¢â‚¬â„¢ÃƒÆ’Ã‚Â¢ÃƒÂ¢Ã¢â‚¬Å¡Ã‚Â¬Ãƒâ€¦Ã‚Â¡ÃƒÆ’Ã†â€™ÃƒÂ¢Ã¢â€šÂ¬Ã…Â¡ÃƒÆ’Ã¢â‚¬Å¡Ãƒâ€šÃ‚Â¢ÃƒÆ’Ã†â€™Ãƒâ€ Ã¢â‚¬â„¢ÃƒÆ’Ã¢â‚¬Â ÃƒÂ¢Ã¢â€šÂ¬Ã¢â€žÂ¢ÃƒÆ’Ã†â€™ÃƒÂ¢Ã¢â€šÂ¬Ã…Â¡ÃƒÆ’Ã¢â‚¬Å¡Ãƒâ€šÃ‚Â¢ÃƒÆ’Ã†â€™Ãƒâ€ Ã¢â‚¬â„¢ÃƒÆ’Ã¢â‚¬Å¡Ãƒâ€šÃ‚Â¢ÃƒÆ’Ã†â€™Ãƒâ€šÃ‚Â¢ÃƒÆ’Ã‚Â¢ÃƒÂ¢Ã¢â‚¬Å¡Ã‚Â¬Ãƒâ€¦Ã‚Â¡ÃƒÆ’Ã¢â‚¬Å¡Ãƒâ€šÃ‚Â¬ÃƒÆ’Ã†â€™ÃƒÂ¢Ã¢â€šÂ¬Ã‚Â¦ÃƒÆ’Ã¢â‚¬Å¡Ãƒâ€šÃ‚Â¡ÃƒÆ’Ã†â€™Ãƒâ€ Ã¢â‚¬â„¢ÃƒÆ’Ã‚Â¢ÃƒÂ¢Ã¢â‚¬Å¡Ã‚Â¬Ãƒâ€¦Ã‚Â¡ÃƒÆ’Ã†â€™ÃƒÂ¢Ã¢â€šÂ¬Ã…Â¡ÃƒÆ’Ã¢â‚¬Å¡Ãƒâ€šÃ‚Â¬ÃƒÆ’Ã†â€™Ãƒâ€ Ã¢â‚¬â„¢ÃƒÆ’Ã¢â‚¬Â ÃƒÂ¢Ã¢â€šÂ¬Ã¢â€žÂ¢ÃƒÆ’Ã†â€™Ãƒâ€šÃ‚Â¢ÃƒÆ’Ã‚Â¢ÃƒÂ¢Ã¢â€šÂ¬Ã…Â¡Ãƒâ€šÃ‚Â¬ÃƒÆ’Ã¢â‚¬Å¡Ãƒâ€šÃ‚Â¦ÃƒÆ’Ã†â€™Ãƒâ€ Ã¢â‚¬â„¢ÃƒÆ’Ã‚Â¢ÃƒÂ¢Ã¢â‚¬Å¡Ã‚Â¬Ãƒâ€¦Ã‚Â¡ÃƒÆ’Ã†â€™ÃƒÂ¢Ã¢â€šÂ¬Ã…Â¡ÃƒÆ’Ã¢â‚¬Å¡Ãƒâ€šÃ‚Â¡ÃƒÆ’Ã†â€™Ãƒâ€ Ã¢â‚¬â„¢ÃƒÆ’Ã¢â‚¬Â ÃƒÂ¢Ã¢â€šÂ¬Ã¢â€žÂ¢ÃƒÆ’Ã†â€™ÃƒÂ¢Ã¢â€šÂ¬Ã‚Â ÃƒÆ’Ã‚Â¢ÃƒÂ¢Ã¢â‚¬Å¡Ã‚Â¬ÃƒÂ¢Ã¢â‚¬Å¾Ã‚Â¢ÃƒÆ’Ã†â€™Ãƒâ€ Ã¢â‚¬â„¢ÃƒÆ’Ã‚Â¢ÃƒÂ¢Ã¢â‚¬Å¡Ã‚Â¬Ãƒâ€šÃ‚Â ÃƒÆ’Ã†â€™Ãƒâ€šÃ‚Â¢ÃƒÆ’Ã‚Â¢ÃƒÂ¢Ã¢â€šÂ¬Ã…Â¡Ãƒâ€šÃ‚Â¬ÃƒÆ’Ã‚Â¢ÃƒÂ¢Ã¢â€šÂ¬Ã…Â¾Ãƒâ€šÃ‚Â¢ÃƒÆ’Ã†â€™Ãƒâ€ Ã¢â‚¬â„¢ÃƒÆ’Ã¢â‚¬Â ÃƒÂ¢Ã¢â€šÂ¬Ã¢â€žÂ¢ÃƒÆ’Ã†â€™ÃƒÂ¢Ã¢â€šÂ¬Ã…Â¡ÃƒÆ’Ã¢â‚¬Å¡Ãƒâ€šÃ‚Â¢ÃƒÆ’Ã†â€™Ãƒâ€ Ã¢â‚¬â„¢ÃƒÆ’Ã¢â‚¬Å¡Ãƒâ€šÃ‚Â¢ÃƒÆ’Ã†â€™Ãƒâ€šÃ‚Â¢ÃƒÆ’Ã‚Â¢ÃƒÂ¢Ã¢â€šÂ¬Ã…Â¡Ãƒâ€šÃ‚Â¬ÃƒÆ’Ã¢â‚¬Â¦Ãƒâ€šÃ‚Â¡ÃƒÆ’Ã†â€™ÃƒÂ¢Ã¢â€šÂ¬Ã…Â¡ÃƒÆ’Ã¢â‚¬Å¡Ãƒâ€šÃ‚Â¬ÃƒÆ’Ã†â€™Ãƒâ€ Ã¢â‚¬â„¢ÃƒÆ’Ã‚Â¢ÃƒÂ¢Ã¢â‚¬Å¡Ã‚Â¬Ãƒâ€šÃ‚Â¦ÃƒÆ’Ã†â€™ÃƒÂ¢Ã¢â€šÂ¬Ã…Â¡ÃƒÆ’Ã¢â‚¬Å¡Ãƒâ€šÃ‚Â¡ÃƒÆ’Ã†â€™Ãƒâ€ Ã¢â‚¬â„¢ÃƒÆ’Ã¢â‚¬Â ÃƒÂ¢Ã¢â€šÂ¬Ã¢â€žÂ¢ÃƒÆ’Ã†â€™ÃƒÂ¢Ã¢â€šÂ¬Ã‚Â ÃƒÆ’Ã‚Â¢ÃƒÂ¢Ã¢â‚¬Å¡Ã‚Â¬ÃƒÂ¢Ã¢â‚¬Å¾Ã‚Â¢ÃƒÆ’Ã†â€™Ãƒâ€ Ã¢â‚¬â„¢ÃƒÆ’Ã¢â‚¬Å¡Ãƒâ€šÃ‚Â¢ÃƒÆ’Ã†â€™Ãƒâ€šÃ‚Â¢ÃƒÆ’Ã‚Â¢ÃƒÂ¢Ã¢â‚¬Å¡Ã‚Â¬Ãƒâ€¦Ã‚Â¡ÃƒÆ’Ã¢â‚¬Å¡Ãƒâ€šÃ‚Â¬ÃƒÆ’Ã†â€™ÃƒÂ¢Ã¢â€šÂ¬Ã‚Â¦ÃƒÆ’Ã¢â‚¬Å¡Ãƒâ€šÃ‚Â¡ÃƒÆ’Ã†â€™Ãƒâ€ Ã¢â‚¬â„¢ÃƒÆ’Ã¢â‚¬Â ÃƒÂ¢Ã¢â€šÂ¬Ã¢â€žÂ¢ÃƒÆ’Ã†â€™Ãƒâ€šÃ‚Â¢ÃƒÆ’Ã‚Â¢ÃƒÂ¢Ã¢â€šÂ¬Ã…Â¡Ãƒâ€šÃ‚Â¬ÃƒÆ’Ã¢â‚¬Â¦Ãƒâ€šÃ‚Â¡ÃƒÆ’Ã†â€™Ãƒâ€ Ã¢â‚¬â„¢ÃƒÆ’Ã‚Â¢ÃƒÂ¢Ã¢â‚¬Å¡Ã‚Â¬Ãƒâ€¦Ã‚Â¡ÃƒÆ’Ã†â€™ÃƒÂ¢Ã¢â€šÂ¬Ã…Â¡ÃƒÆ’Ã¢â‚¬Å¡Ãƒâ€šÃ‚Â°C)</w:t>
             </w:r>
           </w:p>
         </w:tc>
@@ -8016,7 +8016,7 @@
         <w:rPr>
           <w:rFonts w:ascii="Times New Roman" w:hAnsi="Times New Roman" w:cs="Times New Roman"/>
         </w:rPr>
-        <w:t>-chemical water quality parameters for IMTA (Integrated Multi-Trophic Aquaculture) and Monoculture treatments over a seven-week experimental period. Overall, both systems exhibited similar temporal patterns in temperature and pH, indicating that basic physical parameters followed the same environmental fluctuations in both treatments. Water temperature in both systems showed a declining trend from approximately 28ÃƒÆ’Ã†â€™Ãƒâ€ Ã¢â‚¬â„¢ÃƒÆ’Ã¢â‚¬Â ÃƒÂ¢Ã¢â€šÂ¬Ã¢â€žÂ¢ÃƒÆ’Ã†â€™ÃƒÂ¢Ã¢â€šÂ¬Ã‚Â ÃƒÆ’Ã‚Â¢ÃƒÂ¢Ã¢â‚¬Å¡Ã‚Â¬ÃƒÂ¢Ã¢â‚¬Å¾Ã‚Â¢ÃƒÆ’Ã†â€™Ãƒâ€ Ã¢â‚¬â„¢ÃƒÆ’Ã‚Â¢ÃƒÂ¢Ã¢â‚¬Å¡Ã‚Â¬Ãƒâ€šÃ‚Â ÃƒÆ’Ã†â€™Ãƒâ€šÃ‚Â¢ÃƒÆ’Ã‚Â¢ÃƒÂ¢Ã¢â€šÂ¬Ã…Â¡Ãƒâ€šÃ‚Â¬ÃƒÆ’Ã‚Â¢ÃƒÂ¢Ã¢â€šÂ¬Ã…Â¾Ãƒâ€šÃ‚Â¢ÃƒÆ’Ã†â€™Ãƒâ€ Ã¢â‚¬â„¢ÃƒÆ’Ã¢â‚¬Â ÃƒÂ¢Ã¢â€šÂ¬Ã¢â€žÂ¢ÃƒÆ’Ã†â€™Ãƒâ€šÃ‚Â¢ÃƒÆ’Ã‚Â¢ÃƒÂ¢Ã¢â€šÂ¬Ã…Â¡Ãƒâ€šÃ‚Â¬ÃƒÆ’Ã¢â‚¬Å¡Ãƒâ€šÃ‚Â ÃƒÆ’Ã†â€™Ãƒâ€ Ã¢â‚¬â„¢ÃƒÆ’Ã¢â‚¬Å¡Ãƒâ€šÃ‚Â¢ÃƒÆ’Ã†â€™Ãƒâ€šÃ‚Â¢ÃƒÆ’Ã‚Â¢ÃƒÂ¢Ã¢â‚¬Å¡Ã‚Â¬Ãƒâ€¦Ã‚Â¡ÃƒÆ’Ã¢â‚¬Å¡Ãƒâ€šÃ‚Â¬ÃƒÆ’Ã†â€™Ãƒâ€šÃ‚Â¢ÃƒÆ’Ã‚Â¢ÃƒÂ¢Ã¢â‚¬Å¡Ã‚Â¬Ãƒâ€¦Ã‚Â¾ÃƒÆ’Ã¢â‚¬Å¡Ãƒâ€šÃ‚Â¢ÃƒÆ’Ã†â€™Ãƒâ€ Ã¢â‚¬â„¢ÃƒÆ’Ã¢â‚¬Â ÃƒÂ¢Ã¢â€šÂ¬Ã¢â€žÂ¢ÃƒÆ’Ã†â€™ÃƒÂ¢Ã¢â€šÂ¬Ã‚Â ÃƒÆ’Ã‚Â¢ÃƒÂ¢Ã¢â‚¬Å¡Ã‚Â¬ÃƒÂ¢Ã¢â‚¬Å¾Ã‚Â¢ÃƒÆ’Ã†â€™Ãƒâ€ Ã¢â‚¬â„¢ÃƒÆ’Ã‚Â¢ÃƒÂ¢Ã¢â‚¬Å¡Ã‚Â¬Ãƒâ€¦Ã‚Â¡ÃƒÆ’Ã†â€™ÃƒÂ¢Ã¢â€šÂ¬Ã…Â¡ÃƒÆ’Ã¢â‚¬Å¡Ãƒâ€šÃ‚Â¢ÃƒÆ’Ã†â€™Ãƒâ€ Ã¢â‚¬â„¢ÃƒÆ’Ã¢â‚¬Â ÃƒÂ¢Ã¢â€šÂ¬Ã¢â€žÂ¢ÃƒÆ’Ã†â€™ÃƒÂ¢Ã¢â€šÂ¬Ã…Â¡ÃƒÆ’Ã¢â‚¬Å¡Ãƒâ€šÃ‚Â¢ÃƒÆ’Ã†â€™Ãƒâ€ Ã¢â‚¬â„¢ÃƒÆ’Ã¢â‚¬Å¡Ãƒâ€šÃ‚Â¢ÃƒÆ’Ã†â€™Ãƒâ€šÃ‚Â¢ÃƒÆ’Ã‚Â¢ÃƒÂ¢Ã¢â‚¬Å¡Ã‚Â¬Ãƒâ€¦Ã‚Â¡ÃƒÆ’Ã¢â‚¬Å¡Ãƒâ€šÃ‚Â¬ÃƒÆ’Ã†â€™ÃƒÂ¢Ã¢â€šÂ¬Ã‚Â¦ÃƒÆ’Ã¢â‚¬Å¡Ãƒâ€šÃ‚Â¡ÃƒÆ’Ã†â€™Ãƒâ€ Ã¢â‚¬â„¢ÃƒÆ’Ã‚Â¢ÃƒÂ¢Ã¢â‚¬Å¡Ã‚Â¬Ãƒâ€¦Ã‚Â¡ÃƒÆ’Ã†â€™ÃƒÂ¢Ã¢â€šÂ¬Ã…Â¡ÃƒÆ’Ã¢â‚¬Å¡Ãƒâ€šÃ‚Â¬ÃƒÆ’Ã†â€™Ãƒâ€ Ã¢â‚¬â„¢ÃƒÆ’Ã¢â‚¬Â ÃƒÂ¢Ã¢â€šÂ¬Ã¢â€žÂ¢ÃƒÆ’Ã†â€™Ãƒâ€šÃ‚Â¢ÃƒÆ’Ã‚Â¢ÃƒÂ¢Ã¢â€šÂ¬Ã…Â¡Ãƒâ€šÃ‚Â¬ÃƒÆ’Ã¢â‚¬Å¡Ãƒâ€šÃ‚Â¦ÃƒÆ’Ã†â€™Ãƒâ€ Ã¢â‚¬â„¢ÃƒÆ’Ã‚Â¢ÃƒÂ¢Ã¢â‚¬Å¡Ã‚Â¬Ãƒâ€¦Ã‚Â¡ÃƒÆ’Ã†â€™ÃƒÂ¢Ã¢â€šÂ¬Ã…Â¡ÃƒÆ’Ã¢â‚¬Å¡Ãƒâ€šÃ‚Â¡ÃƒÆ’Ã†â€™Ãƒâ€ Ã¢â‚¬â„¢ÃƒÆ’Ã¢â‚¬Â ÃƒÂ¢Ã¢â€šÂ¬Ã¢â€žÂ¢ÃƒÆ’Ã†â€™ÃƒÂ¢Ã¢â€šÂ¬Ã‚Â ÃƒÆ’Ã‚Â¢ÃƒÂ¢Ã¢â‚¬Å¡Ã‚Â¬ÃƒÂ¢Ã¢â‚¬Å¾Ã‚Â¢ÃƒÆ’Ã†â€™Ãƒâ€ Ã¢â‚¬â„¢ÃƒÆ’Ã‚Â¢ÃƒÂ¢Ã¢â‚¬Å¡Ã‚Â¬Ãƒâ€šÃ‚Â ÃƒÆ’Ã†â€™Ãƒâ€šÃ‚Â¢ÃƒÆ’Ã‚Â¢ÃƒÂ¢Ã¢â€šÂ¬Ã…Â¡Ãƒâ€šÃ‚Â¬ÃƒÆ’Ã‚Â¢ÃƒÂ¢Ã¢â€šÂ¬Ã…Â¾Ãƒâ€šÃ‚Â¢ÃƒÆ’Ã†â€™Ãƒâ€ Ã¢â‚¬â„¢ÃƒÆ’Ã¢â‚¬Â ÃƒÂ¢Ã¢â€šÂ¬Ã¢â€žÂ¢ÃƒÆ’Ã†â€™ÃƒÂ¢Ã¢â€šÂ¬Ã…Â¡ÃƒÆ’Ã¢â‚¬Å¡Ãƒâ€šÃ‚Â¢ÃƒÆ’Ã†â€™Ãƒâ€ Ã¢â‚¬â„¢ÃƒÆ’Ã¢â‚¬Å¡Ãƒâ€šÃ‚Â¢ÃƒÆ’Ã†â€™Ãƒâ€šÃ‚Â¢ÃƒÆ’Ã‚Â¢ÃƒÂ¢Ã¢â€šÂ¬Ã…Â¡Ãƒâ€šÃ‚Â¬ÃƒÆ’Ã¢â‚¬Â¦Ãƒâ€šÃ‚Â¡ÃƒÆ’Ã†â€™ÃƒÂ¢Ã¢â€šÂ¬Ã…Â¡ÃƒÆ’Ã¢â‚¬Å¡Ãƒâ€šÃ‚Â¬ÃƒÆ’Ã†â€™Ãƒâ€ Ã¢â‚¬â„¢ÃƒÆ’Ã‚Â¢ÃƒÂ¢Ã¢â‚¬Å¡Ã‚Â¬Ãƒâ€šÃ‚Â¦ÃƒÆ’Ã†â€™ÃƒÂ¢Ã¢â€šÂ¬Ã…Â¡ÃƒÆ’Ã¢â‚¬Å¡Ãƒâ€šÃ‚Â¡ÃƒÆ’Ã†â€™Ãƒâ€ Ã¢â‚¬â„¢ÃƒÆ’Ã¢â‚¬Â ÃƒÂ¢Ã¢â€šÂ¬Ã¢â€žÂ¢ÃƒÆ’Ã†â€™ÃƒÂ¢Ã¢â€šÂ¬Ã‚Â ÃƒÆ’Ã‚Â¢ÃƒÂ¢Ã¢â‚¬Å¡Ã‚Â¬ÃƒÂ¢Ã¢â‚¬Å¾Ã‚Â¢ÃƒÆ’Ã†â€™Ãƒâ€ Ã¢â‚¬â„¢ÃƒÆ’Ã¢â‚¬Å¡Ãƒâ€šÃ‚Â¢ÃƒÆ’Ã†â€™Ãƒâ€šÃ‚Â¢ÃƒÆ’Ã‚Â¢ÃƒÂ¢Ã¢â‚¬Å¡Ã‚Â¬Ãƒâ€¦Ã‚Â¡ÃƒÆ’Ã¢â‚¬Å¡Ãƒâ€šÃ‚Â¬ÃƒÆ’Ã†â€™ÃƒÂ¢Ã¢â€šÂ¬Ã‚Â¦ÃƒÆ’Ã¢â‚¬Å¡Ãƒâ€šÃ‚Â¡ÃƒÆ’Ã†â€™Ãƒâ€ Ã¢â‚¬â„¢ÃƒÆ’Ã¢â‚¬Â ÃƒÂ¢Ã¢â€šÂ¬Ã¢â€žÂ¢ÃƒÆ’Ã†â€™Ãƒâ€šÃ‚Â¢ÃƒÆ’Ã‚Â¢ÃƒÂ¢Ã¢â€šÂ¬Ã…Â¡Ãƒâ€šÃ‚Â¬ÃƒÆ’Ã¢â‚¬Â¦Ãƒâ€šÃ‚Â¡ÃƒÆ’Ã†â€™Ãƒâ€ Ã¢â‚¬â„¢ÃƒÆ’Ã‚Â¢ÃƒÂ¢Ã¢â‚¬Å¡Ã‚Â¬Ãƒâ€¦Ã‚Â¡ÃƒÆ’Ã†â€™ÃƒÂ¢Ã¢â€šÂ¬Ã…Â¡ÃƒÆ’Ã¢â‚¬Å¡Ãƒâ€šÃ‚Â°C at the beginning to a minimum of around 25.6ÃƒÆ’Ã†â€™Ãƒâ€ Ã¢â‚¬â„¢ÃƒÆ’Ã¢â‚¬Â ÃƒÂ¢Ã¢â€šÂ¬Ã¢â€žÂ¢ÃƒÆ’Ã†â€™ÃƒÂ¢Ã¢â€šÂ¬Ã‚Â ÃƒÆ’Ã‚Â¢ÃƒÂ¢Ã¢â‚¬Å¡Ã‚Â¬ÃƒÂ¢Ã¢â‚¬Å¾Ã‚Â¢ÃƒÆ’Ã†â€™Ãƒâ€ Ã¢â‚¬â„¢ÃƒÆ’Ã‚Â¢ÃƒÂ¢Ã¢â‚¬Å¡Ã‚Â¬Ãƒâ€šÃ‚Â ÃƒÆ’Ã†â€™Ãƒâ€šÃ‚Â¢ÃƒÆ’Ã‚Â¢ÃƒÂ¢Ã¢â€šÂ¬Ã…Â¡Ãƒâ€šÃ‚Â¬ÃƒÆ’Ã‚Â¢ÃƒÂ¢Ã¢â€šÂ¬Ã…Â¾Ãƒâ€šÃ‚Â¢ÃƒÆ’Ã†â€™Ãƒâ€ Ã¢â‚¬â„¢ÃƒÆ’Ã¢â‚¬Â ÃƒÂ¢Ã¢â€šÂ¬Ã¢â€žÂ¢ÃƒÆ’Ã†â€™Ãƒâ€šÃ‚Â¢ÃƒÆ’Ã‚Â¢ÃƒÂ¢Ã¢â€šÂ¬Ã…Â¡Ãƒâ€šÃ‚Â¬ÃƒÆ’Ã¢â‚¬Å¡Ãƒâ€šÃ‚Â ÃƒÆ’Ã†â€™Ãƒâ€ Ã¢â‚¬â„¢ÃƒÆ’Ã¢â‚¬Å¡Ãƒâ€šÃ‚Â¢ÃƒÆ’Ã†â€™Ãƒâ€šÃ‚Â¢ÃƒÆ’Ã‚Â¢ÃƒÂ¢Ã¢â‚¬Å¡Ã‚Â¬Ãƒâ€¦Ã‚Â¡ÃƒÆ’Ã¢â‚¬Å¡Ãƒâ€šÃ‚Â¬ÃƒÆ’Ã†â€™Ãƒâ€šÃ‚Â¢ÃƒÆ’Ã‚Â¢ÃƒÂ¢Ã¢â‚¬Å¡Ã‚Â¬Ãƒâ€¦Ã‚Â¾ÃƒÆ’Ã¢â‚¬Å¡Ãƒâ€šÃ‚Â¢ÃƒÆ’Ã†â€™Ãƒâ€ Ã¢â‚¬â„¢ÃƒÆ’Ã¢â‚¬Â ÃƒÂ¢Ã¢â€šÂ¬Ã¢â€žÂ¢ÃƒÆ’Ã†â€™ÃƒÂ¢Ã¢â€šÂ¬Ã‚Â ÃƒÆ’Ã‚Â¢ÃƒÂ¢Ã¢â‚¬Å¡Ã‚Â¬ÃƒÂ¢Ã¢â‚¬Å¾Ã‚Â¢ÃƒÆ’Ã†â€™Ãƒâ€ Ã¢â‚¬â„¢ÃƒÆ’Ã¢â‚¬Å¡Ãƒâ€šÃ‚Â¢ÃƒÆ’Ã†â€™Ãƒâ€šÃ‚Â¢ÃƒÆ’Ã‚Â¢ÃƒÂ¢Ã¢â‚¬Å¡Ã‚Â¬Ãƒâ€¦Ã‚Â¡ÃƒÆ’Ã¢â‚¬Å¡Ãƒâ€šÃ‚Â¬ÃƒÆ’Ã†â€™ÃƒÂ¢Ã¢â€šÂ¬Ã‚Â¦ÃƒÆ’Ã¢â‚¬Å¡Ãƒâ€šÃ‚Â¡ÃƒÆ’Ã†â€™Ãƒâ€ Ã¢â‚¬â„¢ÃƒÆ’Ã¢â‚¬Â ÃƒÂ¢Ã¢â€šÂ¬Ã¢â€žÂ¢ÃƒÆ’Ã†â€™Ãƒâ€šÃ‚Â¢ÃƒÆ’Ã‚Â¢ÃƒÂ¢Ã¢â€šÂ¬Ã…Â¡Ãƒâ€šÃ‚Â¬ÃƒÆ’Ã¢â‚¬Â¦Ãƒâ€šÃ‚Â¡ÃƒÆ’Ã†â€™Ãƒâ€ Ã¢â‚¬â„¢ÃƒÆ’Ã‚Â¢ÃƒÂ¢Ã¢â‚¬Å¡Ã‚Â¬Ãƒâ€¦Ã‚Â¡ÃƒÆ’Ã†â€™ÃƒÂ¢Ã¢â€šÂ¬Ã…Â¡ÃƒÆ’Ã¢â‚¬Å¡Ãƒâ€šÃ‚Â¢ÃƒÆ’Ã†â€™Ãƒâ€ Ã¢â‚¬â„¢ÃƒÆ’Ã¢â‚¬Â ÃƒÂ¢Ã¢â€šÂ¬Ã¢â€žÂ¢ÃƒÆ’Ã†â€™ÃƒÂ¢Ã¢â€šÂ¬Ã‚Â ÃƒÆ’Ã‚Â¢ÃƒÂ¢Ã¢â‚¬Å¡Ã‚Â¬ÃƒÂ¢Ã¢â‚¬Å¾Ã‚Â¢ÃƒÆ’Ã†â€™Ãƒâ€ Ã¢â‚¬â„¢ÃƒÆ’Ã‚Â¢ÃƒÂ¢Ã¢â‚¬Å¡Ã‚Â¬Ãƒâ€šÃ‚Â ÃƒÆ’Ã†â€™Ãƒâ€šÃ‚Â¢ÃƒÆ’Ã‚Â¢ÃƒÂ¢Ã¢â€šÂ¬Ã…Â¡Ãƒâ€šÃ‚Â¬ÃƒÆ’Ã‚Â¢ÃƒÂ¢Ã¢â€šÂ¬Ã…Â¾Ãƒâ€šÃ‚Â¢ÃƒÆ’Ã†â€™Ãƒâ€ Ã¢â‚¬â„¢ÃƒÆ’Ã¢â‚¬Â ÃƒÂ¢Ã¢â€šÂ¬Ã¢â€žÂ¢ÃƒÆ’Ã†â€™Ãƒâ€šÃ‚Â¢ÃƒÆ’Ã‚Â¢ÃƒÂ¢Ã¢â€šÂ¬Ã…Â¡Ãƒâ€šÃ‚Â¬ÃƒÆ’Ã¢â‚¬Â¦Ãƒâ€šÃ‚Â¡ÃƒÆ’Ã†â€™Ãƒâ€ Ã¢â‚¬â„¢ÃƒÆ’Ã‚Â¢ÃƒÂ¢Ã¢â‚¬Å¡Ã‚Â¬Ãƒâ€¦Ã‚Â¡ÃƒÆ’Ã†â€™ÃƒÂ¢Ã¢â€šÂ¬Ã…Â¡ÃƒÆ’Ã¢â‚¬Å¡Ãƒâ€šÃ‚Â¢ÃƒÆ’Ã†â€™Ãƒâ€ Ã¢â‚¬â„¢ÃƒÆ’Ã¢â‚¬Â ÃƒÂ¢Ã¢â€šÂ¬Ã¢â€žÂ¢ÃƒÆ’Ã†â€™ÃƒÂ¢Ã¢â€šÂ¬Ã‚Â ÃƒÆ’Ã‚Â¢ÃƒÂ¢Ã¢â‚¬Å¡Ã‚Â¬ÃƒÂ¢Ã¢â‚¬Å¾Ã‚Â¢ÃƒÆ’Ã†â€™Ãƒâ€ Ã¢â‚¬â„¢ÃƒÆ’Ã‚Â¢ÃƒÂ¢Ã¢â‚¬Å¡Ã‚Â¬Ãƒâ€¦Ã‚Â¡ÃƒÆ’Ã†â€™ÃƒÂ¢Ã¢â€šÂ¬Ã…Â¡ÃƒÆ’Ã¢â‚¬Å¡Ãƒâ€šÃ‚Â¢ÃƒÆ’Ã†â€™Ãƒâ€ Ã¢â‚¬â„¢ÃƒÆ’Ã¢â‚¬Â ÃƒÂ¢Ã¢â€šÂ¬Ã¢â€žÂ¢ÃƒÆ’Ã†â€™ÃƒÂ¢Ã¢â€šÂ¬Ã…Â¡ÃƒÆ’Ã¢â‚¬Å¡Ãƒâ€šÃ‚Â¢ÃƒÆ’Ã†â€™Ãƒâ€ Ã¢â‚¬â„¢ÃƒÆ’Ã¢â‚¬Å¡Ãƒâ€šÃ‚Â¢ÃƒÆ’Ã†â€™Ãƒâ€šÃ‚Â¢ÃƒÆ’Ã‚Â¢ÃƒÂ¢Ã¢â‚¬Å¡Ã‚Â¬Ãƒâ€¦Ã‚Â¡ÃƒÆ’Ã¢â‚¬Å¡Ãƒâ€šÃ‚Â¬ÃƒÆ’Ã†â€™ÃƒÂ¢Ã¢â€šÂ¬Ã‚Â¦ÃƒÆ’Ã¢â‚¬Å¡Ãƒâ€šÃ‚Â¡ÃƒÆ’Ã†â€™Ãƒâ€ Ã¢â‚¬â„¢ÃƒÆ’Ã‚Â¢ÃƒÂ¢Ã¢â‚¬Å¡Ã‚Â¬Ãƒâ€¦Ã‚Â¡ÃƒÆ’Ã†â€™ÃƒÂ¢Ã¢â€šÂ¬Ã…Â¡ÃƒÆ’Ã¢â‚¬Å¡Ãƒâ€šÃ‚Â¬ÃƒÆ’Ã†â€™Ãƒâ€ Ã¢â‚¬â„¢ÃƒÆ’Ã¢â‚¬Â ÃƒÂ¢Ã¢â€šÂ¬Ã¢â€žÂ¢ÃƒÆ’Ã†â€™Ãƒâ€šÃ‚Â¢ÃƒÆ’Ã‚Â¢ÃƒÂ¢Ã¢â€šÂ¬Ã…Â¡Ãƒâ€šÃ‚Â¬ÃƒÆ’Ã¢â‚¬Å¡Ãƒâ€šÃ‚Â¦ÃƒÆ’Ã†â€™Ãƒâ€ Ã¢â‚¬â„¢ÃƒÆ’Ã‚Â¢ÃƒÂ¢Ã¢â‚¬Å¡Ã‚Â¬Ãƒâ€¦Ã‚Â¡ÃƒÆ’Ã†â€™ÃƒÂ¢Ã¢â€šÂ¬Ã…Â¡ÃƒÆ’Ã¢â‚¬Å¡Ãƒâ€šÃ‚Â¡ÃƒÆ’Ã†â€™Ãƒâ€ Ã¢â‚¬â„¢ÃƒÆ’Ã¢â‚¬Â ÃƒÂ¢Ã¢â€šÂ¬Ã¢â€žÂ¢ÃƒÆ’Ã†â€™ÃƒÂ¢Ã¢â€šÂ¬Ã‚Â ÃƒÆ’Ã‚Â¢ÃƒÂ¢Ã¢â‚¬Å¡Ã‚Â¬ÃƒÂ¢Ã¢â‚¬Å¾Ã‚Â¢ÃƒÆ’Ã†â€™Ãƒâ€ Ã¢â‚¬â„¢ÃƒÆ’Ã¢â‚¬Å¡Ãƒâ€šÃ‚Â¢ÃƒÆ’Ã†â€™Ãƒâ€šÃ‚Â¢ÃƒÆ’Ã‚Â¢ÃƒÂ¢Ã¢â‚¬Å¡Ã‚Â¬Ãƒâ€¦Ã‚Â¡ÃƒÆ’Ã¢â‚¬Å¡Ãƒâ€šÃ‚Â¬ÃƒÆ’Ã†â€™ÃƒÂ¢Ã¢â€šÂ¬Ã‚Â¦ÃƒÆ’Ã¢â‚¬Å¡Ãƒâ€šÃ‚Â¡ÃƒÆ’Ã†â€™Ãƒâ€ Ã¢â‚¬â„¢ÃƒÆ’Ã¢â‚¬Â ÃƒÂ¢Ã¢â€šÂ¬Ã¢â€žÂ¢ÃƒÆ’Ã†â€™Ãƒâ€šÃ‚Â¢ÃƒÆ’Ã‚Â¢ÃƒÂ¢Ã¢â€šÂ¬Ã…Â¡Ãƒâ€šÃ‚Â¬ÃƒÆ’Ã¢â‚¬Â¦Ãƒâ€šÃ‚Â¡ÃƒÆ’Ã†â€™Ãƒâ€ Ã¢â‚¬â„¢ÃƒÆ’Ã‚Â¢ÃƒÂ¢Ã¢â‚¬Å¡Ã‚Â¬Ãƒâ€¦Ã‚Â¡ÃƒÆ’Ã†â€™ÃƒÂ¢Ã¢â€šÂ¬Ã…Â¡ÃƒÆ’Ã¢â‚¬Å¡Ãƒâ€šÃ‚Â¬ÃƒÆ’Ã†â€™Ãƒâ€ Ã¢â‚¬â„¢ÃƒÆ’Ã¢â‚¬Â ÃƒÂ¢Ã¢â€šÂ¬Ã¢â€žÂ¢ÃƒÆ’Ã†â€™ÃƒÂ¢Ã¢â€šÂ¬Ã‚Â ÃƒÆ’Ã‚Â¢ÃƒÂ¢Ã¢â‚¬Å¡Ã‚Â¬ÃƒÂ¢Ã¢â‚¬Å¾Ã‚Â¢ÃƒÆ’Ã†â€™Ãƒâ€ Ã¢â‚¬â„¢ÃƒÆ’Ã‚Â¢ÃƒÂ¢Ã¢â‚¬Å¡Ã‚Â¬Ãƒâ€šÃ‚Â ÃƒÆ’Ã†â€™Ãƒâ€šÃ‚Â¢ÃƒÆ’Ã‚Â¢ÃƒÂ¢Ã¢â€šÂ¬Ã…Â¡Ãƒâ€šÃ‚Â¬ÃƒÆ’Ã‚Â¢ÃƒÂ¢Ã¢â€šÂ¬Ã…Â¾Ãƒâ€šÃ‚Â¢ÃƒÆ’Ã†â€™Ãƒâ€ Ã¢â‚¬â„¢ÃƒÆ’Ã¢â‚¬Â ÃƒÂ¢Ã¢â€šÂ¬Ã¢â€žÂ¢ÃƒÆ’Ã†â€™Ãƒâ€šÃ‚Â¢ÃƒÆ’Ã‚Â¢ÃƒÂ¢Ã¢â€šÂ¬Ã…Â¡Ãƒâ€šÃ‚Â¬ÃƒÆ’Ã¢â‚¬Â¦Ãƒâ€šÃ‚Â¡ÃƒÆ’Ã†â€™Ãƒâ€ Ã¢â‚¬â„¢ÃƒÆ’Ã‚Â¢ÃƒÂ¢Ã¢â‚¬Å¡Ã‚Â¬Ãƒâ€¦Ã‚Â¡ÃƒÆ’Ã†â€™ÃƒÂ¢Ã¢â€šÂ¬Ã…Â¡ÃƒÆ’Ã¢â‚¬Å¡Ãƒâ€šÃ‚Â¢ÃƒÆ’Ã†â€™Ãƒâ€ Ã¢â‚¬â„¢ÃƒÆ’Ã¢â‚¬Â ÃƒÂ¢Ã¢â€šÂ¬Ã¢â€žÂ¢ÃƒÆ’Ã†â€™ÃƒÂ¢Ã¢â€šÂ¬Ã‚Â ÃƒÆ’Ã‚Â¢ÃƒÂ¢Ã¢â‚¬Å¡Ã‚Â¬ÃƒÂ¢Ã¢â‚¬Å¾Ã‚Â¢ÃƒÆ’Ã†â€™Ãƒâ€ Ã¢â‚¬â„¢ÃƒÆ’Ã‚Â¢ÃƒÂ¢Ã¢â‚¬Å¡Ã‚Â¬Ãƒâ€¦Ã‚Â¡ÃƒÆ’Ã†â€™ÃƒÂ¢Ã¢â€šÂ¬Ã…Â¡ÃƒÆ’Ã¢â‚¬Å¡Ãƒâ€šÃ‚Â¢ÃƒÆ’Ã†â€™Ãƒâ€ Ã¢â‚¬â„¢ÃƒÆ’Ã¢â‚¬Â ÃƒÂ¢Ã¢â€šÂ¬Ã¢â€žÂ¢ÃƒÆ’Ã†â€™ÃƒÂ¢Ã¢â€šÂ¬Ã…Â¡ÃƒÆ’Ã¢â‚¬Å¡Ãƒâ€šÃ‚Â¢ÃƒÆ’Ã†â€™Ãƒâ€ Ã¢â‚¬â„¢ÃƒÆ’Ã¢â‚¬Å¡Ãƒâ€šÃ‚Â¢ÃƒÆ’Ã†â€™Ãƒâ€šÃ‚Â¢ÃƒÆ’Ã‚Â¢ÃƒÂ¢Ã¢â€šÂ¬Ã…Â¡Ãƒâ€šÃ‚Â¬ÃƒÆ’Ã¢â‚¬Â¦Ãƒâ€šÃ‚Â¡ÃƒÆ’Ã†â€™ÃƒÂ¢Ã¢â€šÂ¬Ã…Â¡ÃƒÆ’Ã¢â‚¬Å¡Ãƒâ€šÃ‚Â¬ÃƒÆ’Ã†â€™Ãƒâ€ Ã¢â‚¬â„¢ÃƒÆ’Ã‚Â¢ÃƒÂ¢Ã¢â‚¬Å¡Ã‚Â¬Ãƒâ€šÃ‚Â¦ÃƒÆ’Ã†â€™ÃƒÂ¢Ã¢â€šÂ¬Ã…Â¡ÃƒÆ’Ã¢â‚¬Å¡Ãƒâ€šÃ‚Â¡ÃƒÆ’Ã†â€™Ãƒâ€ Ã¢â‚¬â„¢ÃƒÆ’Ã¢â‚¬Â ÃƒÂ¢Ã¢â€šÂ¬Ã¢â€žÂ¢ÃƒÆ’Ã†â€™Ãƒâ€šÃ‚Â¢ÃƒÆ’Ã‚Â¢ÃƒÂ¢Ã¢â€šÂ¬Ã…Â¡Ãƒâ€šÃ‚Â¬ÃƒÆ’Ã¢â‚¬Â¦Ãƒâ€šÃ‚Â¡ÃƒÆ’Ã†â€™Ãƒâ€ Ã¢â‚¬â„¢ÃƒÆ’Ã‚Â¢ÃƒÂ¢Ã¢â‚¬Å¡Ã‚Â¬Ãƒâ€¦Ã‚Â¡ÃƒÆ’Ã†â€™ÃƒÂ¢Ã¢â€šÂ¬Ã…Â¡ÃƒÆ’Ã¢â‚¬Å¡Ãƒâ€šÃ‚Â¬ÃƒÆ’Ã†â€™Ãƒâ€ Ã¢â‚¬â„¢ÃƒÆ’Ã¢â‚¬Â ÃƒÂ¢Ã¢â€šÂ¬Ã¢â€žÂ¢ÃƒÆ’Ã†â€™ÃƒÂ¢Ã¢â€šÂ¬Ã‚Â ÃƒÆ’Ã‚Â¢ÃƒÂ¢Ã¢â‚¬Å¡Ã‚Â¬ÃƒÂ¢Ã¢â‚¬Å¾Ã‚Â¢ÃƒÆ’Ã†â€™Ãƒâ€ Ã¢â‚¬â„¢ÃƒÆ’Ã¢â‚¬Å¡Ãƒâ€šÃ‚Â¢ÃƒÆ’Ã†â€™Ãƒâ€šÃ‚Â¢ÃƒÆ’Ã‚Â¢ÃƒÂ¢Ã¢â‚¬Å¡Ã‚Â¬Ãƒâ€¦Ã‚Â¡ÃƒÆ’Ã¢â‚¬Å¡Ãƒâ€šÃ‚Â¬ÃƒÆ’Ã†â€™ÃƒÂ¢Ã¢â€šÂ¬Ã…Â¡ÃƒÆ’Ã¢â‚¬Å¡Ãƒâ€šÃ‚Â¦ÃƒÆ’Ã†â€™Ãƒâ€ Ã¢â‚¬â„¢ÃƒÆ’Ã¢â‚¬Â ÃƒÂ¢Ã¢â€šÂ¬Ã¢â€žÂ¢ÃƒÆ’Ã†â€™ÃƒÂ¢Ã¢â€šÂ¬Ã…Â¡ÃƒÆ’Ã¢â‚¬Å¡Ãƒâ€šÃ‚Â¢ÃƒÆ’Ã†â€™Ãƒâ€ Ã¢â‚¬â„¢ÃƒÆ’Ã¢â‚¬Å¡Ãƒâ€šÃ‚Â¢ÃƒÆ’Ã†â€™Ãƒâ€šÃ‚Â¢ÃƒÆ’Ã‚Â¢ÃƒÂ¢Ã¢â€šÂ¬Ã…Â¡Ãƒâ€šÃ‚Â¬ÃƒÆ’Ã¢â‚¬Â¦Ãƒâ€šÃ‚Â¡ÃƒÆ’Ã†â€™ÃƒÂ¢Ã¢â€šÂ¬Ã…Â¡ÃƒÆ’Ã¢â‚¬Å¡Ãƒâ€šÃ‚Â¬ÃƒÆ’Ã†â€™Ãƒâ€ Ã¢â‚¬â„¢ÃƒÆ’Ã‚Â¢ÃƒÂ¢Ã¢â‚¬Å¡Ã‚Â¬Ãƒâ€šÃ‚Â¦ÃƒÆ’Ã†â€™Ãƒâ€šÃ‚Â¢ÃƒÆ’Ã‚Â¢ÃƒÂ¢Ã¢â€šÂ¬Ã…Â¡Ãƒâ€šÃ‚Â¬ÃƒÆ’Ã¢â‚¬Â¦ÃƒÂ¢Ã¢â€šÂ¬Ã…â€œ25.9ÃƒÆ’Ã†â€™Ãƒâ€ Ã¢â‚¬â„¢ÃƒÆ’Ã¢â‚¬Â ÃƒÂ¢Ã¢â€šÂ¬Ã¢â€žÂ¢ÃƒÆ’Ã†â€™ÃƒÂ¢Ã¢â€šÂ¬Ã‚Â ÃƒÆ’Ã‚Â¢ÃƒÂ¢Ã¢â‚¬Å¡Ã‚Â¬ÃƒÂ¢Ã¢â‚¬Å¾Ã‚Â¢ÃƒÆ’Ã†â€™Ãƒâ€ Ã¢â‚¬â„¢ÃƒÆ’Ã‚Â¢ÃƒÂ¢Ã¢â‚¬Å¡Ã‚Â¬Ãƒâ€šÃ‚Â ÃƒÆ’Ã†â€™Ãƒâ€šÃ‚Â¢ÃƒÆ’Ã‚Â¢ÃƒÂ¢Ã¢â€šÂ¬Ã…Â¡Ãƒâ€šÃ‚Â¬ÃƒÆ’Ã‚Â¢ÃƒÂ¢Ã¢â€šÂ¬Ã…Â¾Ãƒâ€šÃ‚Â¢ÃƒÆ’Ã†â€™Ãƒâ€ Ã¢â‚¬â„¢ÃƒÆ’Ã¢â‚¬Â ÃƒÂ¢Ã¢â€šÂ¬Ã¢â€žÂ¢ÃƒÆ’Ã†â€™Ãƒâ€šÃ‚Â¢ÃƒÆ’Ã‚Â¢ÃƒÂ¢Ã¢â€šÂ¬Ã…Â¡Ãƒâ€šÃ‚Â¬ÃƒÆ’Ã¢â‚¬Å¡Ãƒâ€šÃ‚Â ÃƒÆ’Ã†â€™Ãƒâ€ Ã¢â‚¬â„¢ÃƒÆ’Ã¢â‚¬Å¡Ãƒâ€šÃ‚Â¢ÃƒÆ’Ã†â€™Ãƒâ€šÃ‚Â¢ÃƒÆ’Ã‚Â¢ÃƒÂ¢Ã¢â‚¬Å¡Ã‚Â¬Ãƒâ€¦Ã‚Â¡ÃƒÆ’Ã¢â‚¬Å¡Ãƒâ€šÃ‚Â¬ÃƒÆ’Ã†â€™Ãƒâ€šÃ‚Â¢ÃƒÆ’Ã‚Â¢ÃƒÂ¢Ã¢â‚¬Å¡Ã‚Â¬Ãƒâ€¦Ã‚Â¾ÃƒÆ’Ã¢â‚¬Å¡Ãƒâ€šÃ‚Â¢ÃƒÆ’Ã†â€™Ãƒâ€ Ã¢â‚¬â„¢ÃƒÆ’Ã¢â‚¬Â ÃƒÂ¢Ã¢â€šÂ¬Ã¢â€žÂ¢ÃƒÆ’Ã†â€™ÃƒÂ¢Ã¢â€šÂ¬Ã‚Â ÃƒÆ’Ã‚Â¢ÃƒÂ¢Ã¢â‚¬Å¡Ã‚Â¬ÃƒÂ¢Ã¢â‚¬Å¾Ã‚Â¢ÃƒÆ’Ã†â€™Ãƒâ€ Ã¢â‚¬â„¢ÃƒÆ’Ã‚Â¢ÃƒÂ¢Ã¢â‚¬Å¡Ã‚Â¬Ãƒâ€¦Ã‚Â¡ÃƒÆ’Ã†â€™ÃƒÂ¢Ã¢â€šÂ¬Ã…Â¡ÃƒÆ’Ã¢â‚¬Å¡Ãƒâ€šÃ‚Â¢ÃƒÆ’Ã†â€™Ãƒâ€ Ã¢â‚¬â„¢ÃƒÆ’Ã¢â‚¬Â ÃƒÂ¢Ã¢â€šÂ¬Ã¢â€žÂ¢ÃƒÆ’Ã†â€™ÃƒÂ¢Ã¢â€šÂ¬Ã…Â¡ÃƒÆ’Ã¢â‚¬Å¡Ãƒâ€šÃ‚Â¢ÃƒÆ’Ã†â€™Ãƒâ€ Ã¢â‚¬â„¢ÃƒÆ’Ã¢â‚¬Å¡Ãƒâ€šÃ‚Â¢ÃƒÆ’Ã†â€™Ãƒâ€šÃ‚Â¢ÃƒÆ’Ã‚Â¢ÃƒÂ¢Ã¢â‚¬Å¡Ã‚Â¬Ãƒâ€¦Ã‚Â¡ÃƒÆ’Ã¢â‚¬Å¡Ãƒâ€šÃ‚Â¬ÃƒÆ’Ã†â€™ÃƒÂ¢Ã¢â€šÂ¬Ã‚Â¦ÃƒÆ’Ã¢â‚¬Å¡Ãƒâ€šÃ‚Â¡ÃƒÆ’Ã†â€™Ãƒâ€ Ã¢â‚¬â„¢ÃƒÆ’Ã‚Â¢ÃƒÂ¢Ã¢â‚¬Å¡Ã‚Â¬Ãƒâ€¦Ã‚Â¡ÃƒÆ’Ã†â€™ÃƒÂ¢Ã¢â€šÂ¬Ã…Â¡ÃƒÆ’Ã¢â‚¬Å¡Ãƒâ€šÃ‚Â¬ÃƒÆ’Ã†â€™Ãƒâ€ Ã¢â‚¬â„¢ÃƒÆ’Ã¢â‚¬Â ÃƒÂ¢Ã¢â€šÂ¬Ã¢â€žÂ¢ÃƒÆ’Ã†â€™Ãƒâ€šÃ‚Â¢ÃƒÆ’Ã‚Â¢ÃƒÂ¢Ã¢â€šÂ¬Ã…Â¡Ãƒâ€šÃ‚Â¬ÃƒÆ’Ã¢â‚¬Å¡Ãƒâ€šÃ‚Â¦ÃƒÆ’Ã†â€™Ãƒâ€ Ã¢â‚¬â„¢ÃƒÆ’Ã‚Â¢ÃƒÂ¢Ã¢â‚¬Å¡Ã‚Â¬Ãƒâ€¦Ã‚Â¡ÃƒÆ’Ã†â€™ÃƒÂ¢Ã¢â€šÂ¬Ã…Â¡ÃƒÆ’Ã¢â‚¬Å¡Ãƒâ€šÃ‚Â¡ÃƒÆ’Ã†â€™Ãƒâ€ Ã¢â‚¬â„¢ÃƒÆ’Ã¢â‚¬Â ÃƒÂ¢Ã¢â€šÂ¬Ã¢â€žÂ¢ÃƒÆ’Ã†â€™ÃƒÂ¢Ã¢â€šÂ¬Ã‚Â ÃƒÆ’Ã‚Â¢ÃƒÂ¢Ã¢â‚¬Å¡Ã‚Â¬ÃƒÂ¢Ã¢â‚¬Å¾Ã‚Â¢ÃƒÆ’Ã†â€™Ãƒâ€ Ã¢â‚¬â„¢ÃƒÆ’Ã‚Â¢ÃƒÂ¢Ã¢â‚¬Å¡Ã‚Â¬Ãƒâ€šÃ‚Â ÃƒÆ’Ã†â€™Ãƒâ€šÃ‚Â¢ÃƒÆ’Ã‚Â¢ÃƒÂ¢Ã¢â€šÂ¬Ã…Â¡Ãƒâ€šÃ‚Â¬ÃƒÆ’Ã‚Â¢ÃƒÂ¢Ã¢â€šÂ¬Ã…Â¾Ãƒâ€šÃ‚Â¢ÃƒÆ’Ã†â€™Ãƒâ€ Ã¢â‚¬â„¢ÃƒÆ’Ã¢â‚¬Â ÃƒÂ¢Ã¢â€šÂ¬Ã¢â€žÂ¢ÃƒÆ’Ã†â€™ÃƒÂ¢Ã¢â€šÂ¬Ã…Â¡ÃƒÆ’Ã¢â‚¬Å¡Ãƒâ€šÃ‚Â¢ÃƒÆ’Ã†â€™Ãƒâ€ Ã¢â‚¬â„¢ÃƒÆ’Ã¢â‚¬Å¡Ãƒâ€šÃ‚Â¢ÃƒÆ’Ã†â€™Ãƒâ€šÃ‚Â¢ÃƒÆ’Ã‚Â¢ÃƒÂ¢Ã¢â€šÂ¬Ã…Â¡Ãƒâ€šÃ‚Â¬ÃƒÆ’Ã¢â‚¬Â¦Ãƒâ€šÃ‚Â¡ÃƒÆ’Ã†â€™ÃƒÂ¢Ã¢â€šÂ¬Ã…Â¡ÃƒÆ’Ã¢â‚¬Å¡Ãƒâ€šÃ‚Â¬ÃƒÆ’Ã†â€™Ãƒâ€ Ã¢â‚¬â„¢ÃƒÆ’Ã‚Â¢ÃƒÂ¢Ã¢â‚¬Å¡Ã‚Â¬Ãƒâ€šÃ‚Â¦ÃƒÆ’Ã†â€™ÃƒÂ¢Ã¢â€šÂ¬Ã…Â¡ÃƒÆ’Ã¢â‚¬Å¡Ãƒâ€šÃ‚Â¡ÃƒÆ’Ã†â€™Ãƒâ€ Ã¢â‚¬â„¢ÃƒÆ’Ã¢â‚¬Â ÃƒÂ¢Ã¢â€šÂ¬Ã¢â€žÂ¢ÃƒÆ’Ã†â€™ÃƒÂ¢Ã¢â€šÂ¬Ã‚Â ÃƒÆ’Ã‚Â¢ÃƒÂ¢Ã¢â‚¬Å¡Ã‚Â¬ÃƒÂ¢Ã¢â‚¬Å¾Ã‚Â¢ÃƒÆ’Ã†â€™Ãƒâ€ Ã¢â‚¬â„¢ÃƒÆ’Ã¢â‚¬Å¡Ãƒâ€šÃ‚Â¢ÃƒÆ’Ã†â€™Ãƒâ€šÃ‚Â¢ÃƒÆ’Ã‚Â¢ÃƒÂ¢Ã¢â‚¬Å¡Ã‚Â¬Ãƒâ€¦Ã‚Â¡ÃƒÆ’Ã¢â‚¬Å¡Ãƒâ€šÃ‚Â¬ÃƒÆ’Ã†â€™ÃƒÂ¢Ã¢â€šÂ¬Ã‚Â¦ÃƒÆ’Ã¢â‚¬Å¡Ãƒâ€šÃ‚Â¡ÃƒÆ’Ã†â€™Ãƒâ€ Ã¢â‚¬â„¢ÃƒÆ’Ã¢â‚¬Â ÃƒÂ¢Ã¢â€šÂ¬Ã¢â€žÂ¢ÃƒÆ’Ã†â€™Ãƒâ€šÃ‚Â¢ÃƒÆ’Ã‚Â¢ÃƒÂ¢Ã¢â€šÂ¬Ã…Â¡Ãƒâ€šÃ‚Â¬ÃƒÆ’Ã¢â‚¬Â¦Ãƒâ€šÃ‚Â¡ÃƒÆ’Ã†â€™Ãƒâ€ Ã¢â‚¬â„¢ÃƒÆ’Ã‚Â¢ÃƒÂ¢Ã¢â‚¬Å¡Ã‚Â¬Ãƒâ€¦Ã‚Â¡ÃƒÆ’Ã†â€™ÃƒÂ¢Ã¢â€šÂ¬Ã…Â¡ÃƒÆ’Ã¢â‚¬Å¡Ãƒâ€šÃ‚Â°C in Week 4, before recovering and stabilizing at about 28.1ÃƒÆ’Ã†â€™Ãƒâ€ Ã¢â‚¬â„¢ÃƒÆ’Ã¢â‚¬Â ÃƒÂ¢Ã¢â€šÂ¬Ã¢â€žÂ¢ÃƒÆ’Ã†â€™ÃƒÂ¢Ã¢â€šÂ¬Ã‚Â ÃƒÆ’Ã‚Â¢ÃƒÂ¢Ã¢â‚¬Å¡Ã‚Â¬ÃƒÂ¢Ã¢â‚¬Å¾Ã‚Â¢ÃƒÆ’Ã†â€™Ãƒâ€ Ã¢â‚¬â„¢ÃƒÆ’Ã‚Â¢ÃƒÂ¢Ã¢â‚¬Å¡Ã‚Â¬Ãƒâ€šÃ‚Â ÃƒÆ’Ã†â€™Ãƒâ€šÃ‚Â¢ÃƒÆ’Ã‚Â¢ÃƒÂ¢Ã¢â€šÂ¬Ã…Â¡Ãƒâ€šÃ‚Â¬ÃƒÆ’Ã‚Â¢ÃƒÂ¢Ã¢â€šÂ¬Ã…Â¾Ãƒâ€šÃ‚Â¢ÃƒÆ’Ã†â€™Ãƒâ€ Ã¢â‚¬â„¢ÃƒÆ’Ã¢â‚¬Â ÃƒÂ¢Ã¢â€šÂ¬Ã¢â€žÂ¢ÃƒÆ’Ã†â€™Ãƒâ€šÃ‚Â¢ÃƒÆ’Ã‚Â¢ÃƒÂ¢Ã¢â€šÂ¬Ã…Â¡Ãƒâ€šÃ‚Â¬ÃƒÆ’Ã¢â‚¬Å¡Ãƒâ€šÃ‚Â ÃƒÆ’Ã†â€™Ãƒâ€ Ã¢â‚¬â„¢ÃƒÆ’Ã¢â‚¬Å¡Ãƒâ€šÃ‚Â¢ÃƒÆ’Ã†â€™Ãƒâ€šÃ‚Â¢ÃƒÆ’Ã‚Â¢ÃƒÂ¢Ã¢â‚¬Å¡Ã‚Â¬Ãƒâ€¦Ã‚Â¡ÃƒÆ’Ã¢â‚¬Å¡Ãƒâ€šÃ‚Â¬ÃƒÆ’Ã†â€™Ãƒâ€šÃ‚Â¢ÃƒÆ’Ã‚Â¢ÃƒÂ¢Ã¢â‚¬Å¡Ã‚Â¬Ãƒâ€¦Ã‚Â¾ÃƒÆ’Ã¢â‚¬Å¡Ãƒâ€šÃ‚Â¢ÃƒÆ’Ã†â€™Ãƒâ€ Ã¢â‚¬â„¢ÃƒÆ’Ã¢â‚¬Â ÃƒÂ¢Ã¢â€šÂ¬Ã¢â€žÂ¢ÃƒÆ’Ã†â€™ÃƒÂ¢Ã¢â€šÂ¬Ã‚Â ÃƒÆ’Ã‚Â¢ÃƒÂ¢Ã¢â‚¬Å¡Ã‚Â¬ÃƒÂ¢Ã¢â‚¬Å¾Ã‚Â¢ÃƒÆ’Ã†â€™Ãƒâ€ Ã¢â‚¬â„¢ÃƒÆ’Ã‚Â¢ÃƒÂ¢Ã¢â‚¬Å¡Ã‚Â¬Ãƒâ€¦Ã‚Â¡ÃƒÆ’Ã†â€™ÃƒÂ¢Ã¢â€šÂ¬Ã…Â¡ÃƒÆ’Ã¢â‚¬Å¡Ãƒâ€šÃ‚Â¢ÃƒÆ’Ã†â€™Ãƒâ€ Ã¢â‚¬â„¢ÃƒÆ’Ã¢â‚¬Â ÃƒÂ¢Ã¢â€šÂ¬Ã¢â€žÂ¢ÃƒÆ’Ã†â€™ÃƒÂ¢Ã¢â€šÂ¬Ã…Â¡ÃƒÆ’Ã¢â‚¬Å¡Ãƒâ€šÃ‚Â¢ÃƒÆ’Ã†â€™Ãƒâ€ Ã¢â‚¬â„¢ÃƒÆ’Ã¢â‚¬Å¡Ãƒâ€šÃ‚Â¢ÃƒÆ’Ã†â€™Ãƒâ€šÃ‚Â¢ÃƒÆ’Ã‚Â¢ÃƒÂ¢Ã¢â‚¬Å¡Ã‚Â¬Ãƒâ€¦Ã‚Â¡ÃƒÆ’Ã¢â‚¬Å¡Ãƒâ€šÃ‚Â¬ÃƒÆ’Ã†â€™ÃƒÂ¢Ã¢â€šÂ¬Ã‚Â¦ÃƒÆ’Ã¢â‚¬Å¡Ãƒâ€šÃ‚Â¡ÃƒÆ’Ã†â€™Ãƒâ€ Ã¢â‚¬â„¢ÃƒÆ’Ã‚Â¢ÃƒÂ¢Ã¢â‚¬Å¡Ã‚Â¬Ãƒâ€¦Ã‚Â¡ÃƒÆ’Ã†â€™ÃƒÂ¢Ã¢â€šÂ¬Ã…Â¡ÃƒÆ’Ã¢â‚¬Å¡Ãƒâ€šÃ‚Â¬ÃƒÆ’Ã†â€™Ãƒâ€ Ã¢â‚¬â„¢ÃƒÆ’Ã¢â‚¬Â ÃƒÂ¢Ã¢â€šÂ¬Ã¢â€žÂ¢ÃƒÆ’Ã†â€™Ãƒâ€šÃ‚Â¢ÃƒÆ’Ã‚Â¢ÃƒÂ¢Ã¢â€šÂ¬Ã…Â¡Ãƒâ€šÃ‚Â¬ÃƒÆ’Ã¢â‚¬Å¡Ãƒâ€šÃ‚Â¦ÃƒÆ’Ã†â€™Ãƒâ€ Ã¢â‚¬â„¢ÃƒÆ’Ã‚Â¢ÃƒÂ¢Ã¢â‚¬Å¡Ã‚Â¬Ãƒâ€¦Ã‚Â¡ÃƒÆ’Ã†â€™ÃƒÂ¢Ã¢â€šÂ¬Ã…Â¡ÃƒÆ’Ã¢â‚¬Å¡Ãƒâ€šÃ‚Â¡ÃƒÆ’Ã†â€™Ãƒâ€ Ã¢â‚¬â„¢ÃƒÆ’Ã¢â‚¬Â ÃƒÂ¢Ã¢â€šÂ¬Ã¢â€žÂ¢ÃƒÆ’Ã†â€™ÃƒÂ¢Ã¢â€šÂ¬Ã‚Â ÃƒÆ’Ã‚Â¢ÃƒÂ¢Ã¢â‚¬Å¡Ã‚Â¬ÃƒÂ¢Ã¢â‚¬Å¾Ã‚Â¢ÃƒÆ’Ã†â€™Ãƒâ€ Ã¢â‚¬â„¢ÃƒÆ’Ã‚Â¢ÃƒÂ¢Ã¢â‚¬Å¡Ã‚Â¬Ãƒâ€šÃ‚Â ÃƒÆ’Ã†â€™Ãƒâ€šÃ‚Â¢ÃƒÆ’Ã‚Â¢ÃƒÂ¢Ã¢â€šÂ¬Ã…Â¡Ãƒâ€šÃ‚Â¬ÃƒÆ’Ã‚Â¢ÃƒÂ¢Ã¢â€šÂ¬Ã…Â¾Ãƒâ€šÃ‚Â¢ÃƒÆ’Ã†â€™Ãƒâ€ Ã¢â‚¬â„¢ÃƒÆ’Ã¢â‚¬Â ÃƒÂ¢Ã¢â€šÂ¬Ã¢â€žÂ¢ÃƒÆ’Ã†â€™ÃƒÂ¢Ã¢â€šÂ¬Ã…Â¡ÃƒÆ’Ã¢â‚¬Å¡Ãƒâ€šÃ‚Â¢ÃƒÆ’Ã†â€™Ãƒâ€ Ã¢â‚¬â„¢ÃƒÆ’Ã¢â‚¬Å¡Ãƒâ€šÃ‚Â¢ÃƒÆ’Ã†â€™Ãƒâ€šÃ‚Â¢ÃƒÆ’Ã‚Â¢ÃƒÂ¢Ã¢â€šÂ¬Ã…Â¡Ãƒâ€šÃ‚Â¬ÃƒÆ’Ã¢â‚¬Â¦Ãƒâ€šÃ‚Â¡ÃƒÆ’Ã†â€™ÃƒÂ¢Ã¢â€šÂ¬Ã…Â¡ÃƒÆ’Ã¢â‚¬Å¡Ãƒâ€šÃ‚Â¬ÃƒÆ’Ã†â€™Ãƒâ€ Ã¢â‚¬â„¢ÃƒÆ’Ã‚Â¢ÃƒÂ¢Ã¢â‚¬Å¡Ã‚Â¬Ãƒâ€šÃ‚Â¦ÃƒÆ’Ã†â€™ÃƒÂ¢Ã¢â€šÂ¬Ã…Â¡ÃƒÆ’Ã¢â‚¬Å¡Ãƒâ€šÃ‚Â¡ÃƒÆ’Ã†â€™Ãƒâ€ Ã¢â‚¬â„¢ÃƒÆ’Ã¢â‚¬Â ÃƒÂ¢Ã¢â€šÂ¬Ã¢â€žÂ¢ÃƒÆ’Ã†â€™ÃƒÂ¢Ã¢â€šÂ¬Ã‚Â ÃƒÆ’Ã‚Â¢ÃƒÂ¢Ã¢â‚¬Å¡Ã‚Â¬ÃƒÂ¢Ã¢â‚¬Å¾Ã‚Â¢ÃƒÆ’Ã†â€™Ãƒâ€ Ã¢â‚¬â„¢ÃƒÆ’Ã¢â‚¬Å¡Ãƒâ€šÃ‚Â¢ÃƒÆ’Ã†â€™Ãƒâ€šÃ‚Â¢ÃƒÆ’Ã‚Â¢ÃƒÂ¢Ã¢â‚¬Å¡Ã‚Â¬Ãƒâ€¦Ã‚Â¡ÃƒÆ’Ã¢â‚¬Å¡Ãƒâ€šÃ‚Â¬ÃƒÆ’Ã†â€™ÃƒÂ¢Ã¢â€šÂ¬Ã‚Â¦ÃƒÆ’Ã¢â‚¬Å¡Ãƒâ€šÃ‚Â¡ÃƒÆ’Ã†â€™Ãƒâ€ Ã¢â‚¬â„¢ÃƒÆ’Ã¢â‚¬Â ÃƒÂ¢Ã¢â€šÂ¬Ã¢â€žÂ¢ÃƒÆ’Ã†â€™Ãƒâ€šÃ‚Â¢ÃƒÆ’Ã‚Â¢ÃƒÂ¢Ã¢â€šÂ¬Ã…Â¡Ãƒâ€šÃ‚Â¬ÃƒÆ’Ã¢â‚¬Â¦Ãƒâ€šÃ‚Â¡ÃƒÆ’Ã†â€™Ãƒâ€ Ã¢â‚¬â„¢ÃƒÆ’Ã‚Â¢ÃƒÂ¢Ã¢â‚¬Å¡Ã‚Â¬Ãƒâ€¦Ã‚Â¡ÃƒÆ’Ã†â€™ÃƒÂ¢Ã¢â€šÂ¬Ã…Â¡ÃƒÆ’Ã¢â‚¬Å¡Ãƒâ€šÃ‚Â°C by Week 7. Similarly, pH remained consistently alkaline throughout the study, with both treatments peaking in Week 4 (IMTA: 8.35; Monoculture: 8.37) and then gradually declining and stabilizing. From Week 3 onward, the IMTA system generally maintained slightly lower pH values compared to the Monoculture system.</w:t>
+        <w:t>-chemical water quality parameters for IMTA (Integrated Multi-Trophic Aquaculture) and Monoculture treatments over a seven-week experimental period. Overall, both systems exhibited similar temporal patterns in temperature and pH, indicating that basic physical parameters followed the same environmental fluctuations in both treatments. Water temperature in both systems showed a declining trend from approximately 28ÃƒÆ’Ã†â€™Ãƒâ€ Ã¢â‚¬â„¢ÃƒÆ’Ã¢â‚¬Â ÃƒÂ¢Ã¢â€šÂ¬Ã¢â€žÂ¢ÃƒÆ’Ã†â€™ÃƒÂ¢Ã¢â€šÂ¬Ã‚Â ÃƒÆ’Ã‚Â¢ÃƒÂ¢Ã¢â‚¬Å¡Ã‚Â¬ÃƒÂ¢Ã¢â‚¬Å¾Ã‚Â¢ÃƒÆ’Ã†â€™Ãƒâ€ Ã¢â‚¬â„¢ÃƒÆ’Ã‚Â¢ÃƒÂ¢Ã¢â‚¬Å¡Ã‚Â¬Ãƒâ€šÃ‚Â ÃƒÆ’Ã†â€™Ãƒâ€šÃ‚Â¢ÃƒÆ’Ã‚Â¢ÃƒÂ¢Ã¢â€šÂ¬Ã…Â¡Ãƒâ€šÃ‚Â¬ÃƒÆ’Ã‚Â¢ÃƒÂ¢Ã¢â€šÂ¬Ã…Â¾Ãƒâ€šÃ‚Â¢ÃƒÆ’Ã†â€™Ãƒâ€ Ã¢â‚¬â„¢ÃƒÆ’Ã¢â‚¬Â ÃƒÂ¢Ã¢â€šÂ¬Ã¢â€žÂ¢ÃƒÆ’Ã†â€™Ãƒâ€šÃ‚Â¢ÃƒÆ’Ã‚Â¢ÃƒÂ¢Ã¢â€šÂ¬Ã…Â¡Ãƒâ€šÃ‚Â¬ÃƒÆ’Ã¢â‚¬Å¡Ãƒâ€šÃ‚Â ÃƒÆ’Ã†â€™Ãƒâ€ Ã¢â‚¬â„¢ÃƒÆ’Ã¢â‚¬Å¡Ãƒâ€šÃ‚Â¢ÃƒÆ’Ã†â€™Ãƒâ€šÃ‚Â¢ÃƒÆ’Ã‚Â¢ÃƒÂ¢Ã¢â‚¬Å¡Ã‚Â¬Ãƒâ€¦Ã‚Â¡ÃƒÆ’Ã¢â‚¬Å¡Ãƒâ€šÃ‚Â¬ÃƒÆ’Ã†â€™Ãƒâ€šÃ‚Â¢ÃƒÆ’Ã‚Â¢ÃƒÂ¢Ã¢â‚¬Å¡Ã‚Â¬Ãƒâ€¦Ã‚Â¾ÃƒÆ’Ã¢â‚¬Å¡Ãƒâ€šÃ‚Â¢ÃƒÆ’Ã†â€™Ãƒâ€ Ã¢â‚¬â„¢ÃƒÆ’Ã¢â‚¬Â ÃƒÂ¢Ã¢â€šÂ¬Ã¢â€žÂ¢ÃƒÆ’Ã†â€™ÃƒÂ¢Ã¢â€šÂ¬Ã‚Â ÃƒÆ’Ã‚Â¢ÃƒÂ¢Ã¢â‚¬Å¡Ã‚Â¬ÃƒÂ¢Ã¢â‚¬Å¾Ã‚Â¢ÃƒÆ’Ã†â€™Ãƒâ€ Ã¢â‚¬â„¢ÃƒÆ’Ã¢â‚¬Å¡Ãƒâ€šÃ‚Â¢ÃƒÆ’Ã†â€™Ãƒâ€šÃ‚Â¢ÃƒÆ’Ã‚Â¢ÃƒÂ¢Ã¢â‚¬Å¡Ã‚Â¬Ãƒâ€¦Ã‚Â¡ÃƒÆ’Ã¢â‚¬Å¡Ãƒâ€šÃ‚Â¬ÃƒÆ’Ã†â€™ÃƒÂ¢Ã¢â€šÂ¬Ã…Â¡ÃƒÆ’Ã¢â‚¬Å¡Ãƒâ€šÃ‚Â ÃƒÆ’Ã†â€™Ãƒâ€ Ã¢â‚¬â„¢ÃƒÆ’Ã¢â‚¬Â ÃƒÂ¢Ã¢â€šÂ¬Ã¢â€žÂ¢ÃƒÆ’Ã†â€™ÃƒÂ¢Ã¢â€šÂ¬Ã…Â¡ÃƒÆ’Ã¢â‚¬Å¡Ãƒâ€šÃ‚Â¢ÃƒÆ’Ã†â€™Ãƒâ€ Ã¢â‚¬â„¢ÃƒÆ’Ã¢â‚¬Å¡Ãƒâ€šÃ‚Â¢ÃƒÆ’Ã†â€™Ãƒâ€šÃ‚Â¢ÃƒÆ’Ã‚Â¢ÃƒÂ¢Ã¢â€šÂ¬Ã…Â¡Ãƒâ€šÃ‚Â¬ÃƒÆ’Ã¢â‚¬Â¦Ãƒâ€šÃ‚Â¡ÃƒÆ’Ã†â€™ÃƒÂ¢Ã¢â€šÂ¬Ã…Â¡ÃƒÆ’Ã¢â‚¬Å¡Ãƒâ€šÃ‚Â¬ÃƒÆ’Ã†â€™Ãƒâ€ Ã¢â‚¬â„¢ÃƒÆ’Ã¢â‚¬Å¡Ãƒâ€šÃ‚Â¢ÃƒÆ’Ã†â€™Ãƒâ€šÃ‚Â¢ÃƒÆ’Ã‚Â¢ÃƒÂ¢Ã¢â€šÂ¬Ã…Â¡Ãƒâ€šÃ‚Â¬ÃƒÆ’Ã¢â‚¬Â¦Ãƒâ€šÃ‚Â¾ÃƒÆ’Ã†â€™ÃƒÂ¢Ã¢â€šÂ¬Ã…Â¡ÃƒÆ’Ã¢â‚¬Å¡Ãƒâ€šÃ‚Â¢ÃƒÆ’Ã†â€™Ãƒâ€ Ã¢â‚¬â„¢ÃƒÆ’Ã¢â‚¬Â ÃƒÂ¢Ã¢â€šÂ¬Ã¢â€žÂ¢ÃƒÆ’Ã†â€™ÃƒÂ¢Ã¢â€šÂ¬Ã‚Â ÃƒÆ’Ã‚Â¢ÃƒÂ¢Ã¢â‚¬Å¡Ã‚Â¬ÃƒÂ¢Ã¢â‚¬Å¾Ã‚Â¢ÃƒÆ’Ã†â€™Ãƒâ€ Ã¢â‚¬â„¢ÃƒÆ’Ã‚Â¢ÃƒÂ¢Ã¢â‚¬Å¡Ã‚Â¬Ãƒâ€šÃ‚Â ÃƒÆ’Ã†â€™Ãƒâ€šÃ‚Â¢ÃƒÆ’Ã‚Â¢ÃƒÂ¢Ã¢â€šÂ¬Ã…Â¡Ãƒâ€šÃ‚Â¬ÃƒÆ’Ã‚Â¢ÃƒÂ¢Ã¢â€šÂ¬Ã…Â¾Ãƒâ€šÃ‚Â¢ÃƒÆ’Ã†â€™Ãƒâ€ Ã¢â‚¬â„¢ÃƒÆ’Ã¢â‚¬Â ÃƒÂ¢Ã¢â€šÂ¬Ã¢â€žÂ¢ÃƒÆ’Ã†â€™Ãƒâ€šÃ‚Â¢ÃƒÆ’Ã‚Â¢ÃƒÂ¢Ã¢â€šÂ¬Ã…Â¡Ãƒâ€šÃ‚Â¬ÃƒÆ’Ã¢â‚¬Â¦Ãƒâ€šÃ‚Â¡ÃƒÆ’Ã†â€™Ãƒâ€ Ã¢â‚¬â„¢ÃƒÆ’Ã‚Â¢ÃƒÂ¢Ã¢â‚¬Å¡Ã‚Â¬Ãƒâ€¦Ã‚Â¡ÃƒÆ’Ã†â€™ÃƒÂ¢Ã¢â€šÂ¬Ã…Â¡ÃƒÆ’Ã¢â‚¬Å¡Ãƒâ€šÃ‚Â¢ÃƒÆ’Ã†â€™Ãƒâ€ Ã¢â‚¬â„¢ÃƒÆ’Ã¢â‚¬Â ÃƒÂ¢Ã¢â€šÂ¬Ã¢â€žÂ¢ÃƒÆ’Ã†â€™ÃƒÂ¢Ã¢â€šÂ¬Ã‚Â ÃƒÆ’Ã‚Â¢ÃƒÂ¢Ã¢â‚¬Å¡Ã‚Â¬ÃƒÂ¢Ã¢â‚¬Å¾Ã‚Â¢ÃƒÆ’Ã†â€™Ãƒâ€ Ã¢â‚¬â„¢ÃƒÆ’Ã‚Â¢ÃƒÂ¢Ã¢â‚¬Å¡Ã‚Â¬Ãƒâ€¦Ã‚Â¡ÃƒÆ’Ã†â€™ÃƒÂ¢Ã¢â€šÂ¬Ã…Â¡ÃƒÆ’Ã¢â‚¬Å¡Ãƒâ€šÃ‚Â¢ÃƒÆ’Ã†â€™Ãƒâ€ Ã¢â‚¬â„¢ÃƒÆ’Ã¢â‚¬Â ÃƒÂ¢Ã¢â€šÂ¬Ã¢â€žÂ¢ÃƒÆ’Ã†â€™ÃƒÂ¢Ã¢â€šÂ¬Ã…Â¡ÃƒÆ’Ã¢â‚¬Å¡Ãƒâ€šÃ‚Â¢ÃƒÆ’Ã†â€™Ãƒâ€ Ã¢â‚¬â„¢ÃƒÆ’Ã¢â‚¬Å¡Ãƒâ€šÃ‚Â¢ÃƒÆ’Ã†â€™Ãƒâ€šÃ‚Â¢ÃƒÆ’Ã‚Â¢ÃƒÂ¢Ã¢â€šÂ¬Ã…Â¡Ãƒâ€šÃ‚Â¬ÃƒÆ’Ã¢â‚¬Â¦Ãƒâ€šÃ‚Â¡ÃƒÆ’Ã†â€™ÃƒÂ¢Ã¢â€šÂ¬Ã…Â¡ÃƒÆ’Ã¢â‚¬Å¡Ãƒâ€šÃ‚Â¬ÃƒÆ’Ã†â€™Ãƒâ€ Ã¢â‚¬â„¢ÃƒÆ’Ã‚Â¢ÃƒÂ¢Ã¢â‚¬Å¡Ã‚Â¬Ãƒâ€šÃ‚Â¦ÃƒÆ’Ã†â€™ÃƒÂ¢Ã¢â€šÂ¬Ã…Â¡ÃƒÆ’Ã¢â‚¬Å¡Ãƒâ€šÃ‚Â¡ÃƒÆ’Ã†â€™Ãƒâ€ Ã¢â‚¬â„¢ÃƒÆ’Ã¢â‚¬Â ÃƒÂ¢Ã¢â€šÂ¬Ã¢â€žÂ¢ÃƒÆ’Ã†â€™Ãƒâ€šÃ‚Â¢ÃƒÆ’Ã‚Â¢ÃƒÂ¢Ã¢â€šÂ¬Ã…Â¡Ãƒâ€šÃ‚Â¬ÃƒÆ’Ã¢â‚¬Â¦Ãƒâ€šÃ‚Â¡ÃƒÆ’Ã†â€™Ãƒâ€ Ã¢â‚¬â„¢ÃƒÆ’Ã‚Â¢ÃƒÂ¢Ã¢â‚¬Å¡Ã‚Â¬Ãƒâ€¦Ã‚Â¡ÃƒÆ’Ã†â€™ÃƒÂ¢Ã¢â€šÂ¬Ã…Â¡ÃƒÆ’Ã¢â‚¬Å¡Ãƒâ€šÃ‚Â¬ÃƒÆ’Ã†â€™Ãƒâ€ Ã¢â‚¬â„¢ÃƒÆ’Ã¢â‚¬Â ÃƒÂ¢Ã¢â€šÂ¬Ã¢â€žÂ¢ÃƒÆ’Ã†â€™ÃƒÂ¢Ã¢â€šÂ¬Ã‚Â ÃƒÆ’Ã‚Â¢ÃƒÂ¢Ã¢â‚¬Å¡Ã‚Â¬ÃƒÂ¢Ã¢â‚¬Å¾Ã‚Â¢ÃƒÆ’Ã†â€™Ãƒâ€ Ã¢â‚¬â„¢ÃƒÆ’Ã¢â‚¬Å¡Ãƒâ€šÃ‚Â¢ÃƒÆ’Ã†â€™Ãƒâ€šÃ‚Â¢ÃƒÆ’Ã‚Â¢ÃƒÂ¢Ã¢â‚¬Å¡Ã‚Â¬Ãƒâ€¦Ã‚Â¡ÃƒÆ’Ã¢â‚¬Å¡Ãƒâ€šÃ‚Â¬ÃƒÆ’Ã†â€™ÃƒÂ¢Ã¢â€šÂ¬Ã…Â¡ÃƒÆ’Ã¢â‚¬Å¡Ãƒâ€šÃ‚Â¦ÃƒÆ’Ã†â€™Ãƒâ€ Ã¢â‚¬â„¢ÃƒÆ’Ã¢â‚¬Â ÃƒÂ¢Ã¢â€šÂ¬Ã¢â€žÂ¢ÃƒÆ’Ã†â€™Ãƒâ€šÃ‚Â¢ÃƒÆ’Ã‚Â¢ÃƒÂ¢Ã¢â€šÂ¬Ã…Â¡Ãƒâ€šÃ‚Â¬ÃƒÆ’Ã¢â‚¬Â¦Ãƒâ€šÃ‚Â¡ÃƒÆ’Ã†â€™Ãƒâ€ Ã¢â‚¬â„¢ÃƒÆ’Ã‚Â¢ÃƒÂ¢Ã¢â‚¬Å¡Ã‚Â¬Ãƒâ€¦Ã‚Â¡ÃƒÆ’Ã†â€™ÃƒÂ¢Ã¢â€šÂ¬Ã…Â¡ÃƒÆ’Ã¢â‚¬Å¡Ãƒâ€šÃ‚Â¡ÃƒÆ’Ã†â€™Ãƒâ€ Ã¢â‚¬â„¢ÃƒÆ’Ã¢â‚¬Â ÃƒÂ¢Ã¢â€šÂ¬Ã¢â€žÂ¢ÃƒÆ’Ã†â€™ÃƒÂ¢Ã¢â€šÂ¬Ã‚Â ÃƒÆ’Ã‚Â¢ÃƒÂ¢Ã¢â‚¬Å¡Ã‚Â¬ÃƒÂ¢Ã¢â‚¬Å¾Ã‚Â¢ÃƒÆ’Ã†â€™Ãƒâ€ Ã¢â‚¬â„¢ÃƒÆ’Ã‚Â¢ÃƒÂ¢Ã¢â‚¬Å¡Ã‚Â¬Ãƒâ€šÃ‚Â ÃƒÆ’Ã†â€™Ãƒâ€šÃ‚Â¢ÃƒÆ’Ã‚Â¢ÃƒÂ¢Ã¢â€šÂ¬Ã…Â¡Ãƒâ€šÃ‚Â¬ÃƒÆ’Ã‚Â¢ÃƒÂ¢Ã¢â€šÂ¬Ã…Â¾Ãƒâ€šÃ‚Â¢ÃƒÆ’Ã†â€™Ãƒâ€ Ã¢â‚¬â„¢ÃƒÆ’Ã¢â‚¬Â ÃƒÂ¢Ã¢â€šÂ¬Ã¢â€žÂ¢ÃƒÆ’Ã†â€™Ãƒâ€šÃ‚Â¢ÃƒÆ’Ã‚Â¢ÃƒÂ¢Ã¢â€šÂ¬Ã…Â¡Ãƒâ€šÃ‚Â¬ÃƒÆ’Ã¢â‚¬Å¡Ãƒâ€šÃ‚Â ÃƒÆ’Ã†â€™Ãƒâ€ Ã¢â‚¬â„¢ÃƒÆ’Ã¢â‚¬Å¡Ãƒâ€šÃ‚Â¢ÃƒÆ’Ã†â€™Ãƒâ€šÃ‚Â¢ÃƒÆ’Ã‚Â¢ÃƒÂ¢Ã¢â‚¬Å¡Ã‚Â¬Ãƒâ€¦Ã‚Â¡ÃƒÆ’Ã¢â‚¬Å¡Ãƒâ€šÃ‚Â¬ÃƒÆ’Ã†â€™Ãƒâ€šÃ‚Â¢ÃƒÆ’Ã‚Â¢ÃƒÂ¢Ã¢â‚¬Å¡Ã‚Â¬Ãƒâ€¦Ã‚Â¾ÃƒÆ’Ã¢â‚¬Å¡Ãƒâ€šÃ‚Â¢ÃƒÆ’Ã†â€™Ãƒâ€ Ã¢â‚¬â„¢ÃƒÆ’Ã¢â‚¬Â ÃƒÂ¢Ã¢â€šÂ¬Ã¢â€žÂ¢ÃƒÆ’Ã†â€™ÃƒÂ¢Ã¢â€šÂ¬Ã‚Â ÃƒÆ’Ã‚Â¢ÃƒÂ¢Ã¢â‚¬Å¡Ã‚Â¬ÃƒÂ¢Ã¢â‚¬Å¾Ã‚Â¢ÃƒÆ’Ã†â€™Ãƒâ€ Ã¢â‚¬â„¢ÃƒÆ’Ã‚Â¢ÃƒÂ¢Ã¢â‚¬Å¡Ã‚Â¬Ãƒâ€¦Ã‚Â¡ÃƒÆ’Ã†â€™ÃƒÂ¢Ã¢â€šÂ¬Ã…Â¡ÃƒÆ’Ã¢â‚¬Å¡Ãƒâ€šÃ‚Â¢ÃƒÆ’Ã†â€™Ãƒâ€ Ã¢â‚¬â„¢ÃƒÆ’Ã¢â‚¬Â ÃƒÂ¢Ã¢â€šÂ¬Ã¢â€žÂ¢ÃƒÆ’Ã†â€™ÃƒÂ¢Ã¢â€šÂ¬Ã…Â¡ÃƒÆ’Ã¢â‚¬Å¡Ãƒâ€šÃ‚Â¢ÃƒÆ’Ã†â€™Ãƒâ€ Ã¢â‚¬â„¢ÃƒÆ’Ã¢â‚¬Å¡Ãƒâ€šÃ‚Â¢ÃƒÆ’Ã†â€™Ãƒâ€šÃ‚Â¢ÃƒÆ’Ã‚Â¢ÃƒÂ¢Ã¢â‚¬Å¡Ã‚Â¬Ãƒâ€¦Ã‚Â¡ÃƒÆ’Ã¢â‚¬Å¡Ãƒâ€šÃ‚Â¬ÃƒÆ’Ã†â€™ÃƒÂ¢Ã¢â€šÂ¬Ã‚Â¦ÃƒÆ’Ã¢â‚¬Å¡Ãƒâ€šÃ‚Â¡ÃƒÆ’Ã†â€™Ãƒâ€ Ã¢â‚¬â„¢ÃƒÆ’Ã‚Â¢ÃƒÂ¢Ã¢â‚¬Å¡Ã‚Â¬Ãƒâ€¦Ã‚Â¡ÃƒÆ’Ã†â€™ÃƒÂ¢Ã¢â€šÂ¬Ã…Â¡ÃƒÆ’Ã¢â‚¬Å¡Ãƒâ€šÃ‚Â¬ÃƒÆ’Ã†â€™Ãƒâ€ Ã¢â‚¬â„¢ÃƒÆ’Ã¢â‚¬Â ÃƒÂ¢Ã¢â€šÂ¬Ã¢â€žÂ¢ÃƒÆ’Ã†â€™Ãƒâ€šÃ‚Â¢ÃƒÆ’Ã‚Â¢ÃƒÂ¢Ã¢â€šÂ¬Ã…Â¡Ãƒâ€šÃ‚Â¬ÃƒÆ’Ã¢â‚¬Å¡Ãƒâ€šÃ‚Â¦ÃƒÆ’Ã†â€™Ãƒâ€ Ã¢â‚¬â„¢ÃƒÆ’Ã‚Â¢ÃƒÂ¢Ã¢â‚¬Å¡Ã‚Â¬Ãƒâ€¦Ã‚Â¡ÃƒÆ’Ã†â€™ÃƒÂ¢Ã¢â€šÂ¬Ã…Â¡ÃƒÆ’Ã¢â‚¬Å¡Ãƒâ€šÃ‚Â¡ÃƒÆ’Ã†â€™Ãƒâ€ Ã¢â‚¬â„¢ÃƒÆ’Ã¢â‚¬Â ÃƒÂ¢Ã¢â€šÂ¬Ã¢â€žÂ¢ÃƒÆ’Ã†â€™ÃƒÂ¢Ã¢â€šÂ¬Ã‚Â ÃƒÆ’Ã‚Â¢ÃƒÂ¢Ã¢â‚¬Å¡Ã‚Â¬ÃƒÂ¢Ã¢â‚¬Å¾Ã‚Â¢ÃƒÆ’Ã†â€™Ãƒâ€ Ã¢â‚¬â„¢ÃƒÆ’Ã‚Â¢ÃƒÂ¢Ã¢â‚¬Å¡Ã‚Â¬Ãƒâ€šÃ‚Â ÃƒÆ’Ã†â€™Ãƒâ€šÃ‚Â¢ÃƒÆ’Ã‚Â¢ÃƒÂ¢Ã¢â€šÂ¬Ã…Â¡Ãƒâ€šÃ‚Â¬ÃƒÆ’Ã‚Â¢ÃƒÂ¢Ã¢â€šÂ¬Ã…Â¾Ãƒâ€šÃ‚Â¢ÃƒÆ’Ã†â€™Ãƒâ€ Ã¢â‚¬â„¢ÃƒÆ’Ã¢â‚¬Â ÃƒÂ¢Ã¢â€šÂ¬Ã¢â€žÂ¢ÃƒÆ’Ã†â€™ÃƒÂ¢Ã¢â€šÂ¬Ã…Â¡ÃƒÆ’Ã¢â‚¬Å¡Ãƒâ€šÃ‚Â¢ÃƒÆ’Ã†â€™Ãƒâ€ Ã¢â‚¬â„¢ÃƒÆ’Ã¢â‚¬Å¡Ãƒâ€šÃ‚Â¢ÃƒÆ’Ã†â€™Ãƒâ€šÃ‚Â¢ÃƒÆ’Ã‚Â¢ÃƒÂ¢Ã¢â€šÂ¬Ã…Â¡Ãƒâ€šÃ‚Â¬ÃƒÆ’Ã¢â‚¬Â¦Ãƒâ€šÃ‚Â¡ÃƒÆ’Ã†â€™ÃƒÂ¢Ã¢â€šÂ¬Ã…Â¡ÃƒÆ’Ã¢â‚¬Å¡Ãƒâ€šÃ‚Â¬ÃƒÆ’Ã†â€™Ãƒâ€ Ã¢â‚¬â„¢ÃƒÆ’Ã‚Â¢ÃƒÂ¢Ã¢â‚¬Å¡Ã‚Â¬Ãƒâ€šÃ‚Â¦ÃƒÆ’Ã†â€™ÃƒÂ¢Ã¢â€šÂ¬Ã…Â¡ÃƒÆ’Ã¢â‚¬Å¡Ãƒâ€šÃ‚Â¡ÃƒÆ’Ã†â€™Ãƒâ€ Ã¢â‚¬â„¢ÃƒÆ’Ã¢â‚¬Â ÃƒÂ¢Ã¢â€šÂ¬Ã¢â€žÂ¢ÃƒÆ’Ã†â€™ÃƒÂ¢Ã¢â€šÂ¬Ã‚Â ÃƒÆ’Ã‚Â¢ÃƒÂ¢Ã¢â‚¬Å¡Ã‚Â¬ÃƒÂ¢Ã¢â‚¬Å¾Ã‚Â¢ÃƒÆ’Ã†â€™Ãƒâ€ Ã¢â‚¬â„¢ÃƒÆ’Ã¢â‚¬Å¡Ãƒâ€šÃ‚Â¢ÃƒÆ’Ã†â€™Ãƒâ€šÃ‚Â¢ÃƒÆ’Ã‚Â¢ÃƒÂ¢Ã¢â‚¬Å¡Ã‚Â¬Ãƒâ€¦Ã‚Â¡ÃƒÆ’Ã¢â‚¬Å¡Ãƒâ€šÃ‚Â¬ÃƒÆ’Ã†â€™ÃƒÂ¢Ã¢â€šÂ¬Ã‚Â¦ÃƒÆ’Ã¢â‚¬Å¡Ãƒâ€šÃ‚Â¡ÃƒÆ’Ã†â€™Ãƒâ€ Ã¢â‚¬â„¢ÃƒÆ’Ã¢â‚¬Â ÃƒÂ¢Ã¢â€šÂ¬Ã¢â€žÂ¢ÃƒÆ’Ã†â€™Ãƒâ€šÃ‚Â¢ÃƒÆ’Ã‚Â¢ÃƒÂ¢Ã¢â€šÂ¬Ã…Â¡Ãƒâ€šÃ‚Â¬ÃƒÆ’Ã¢â‚¬Â¦Ãƒâ€šÃ‚Â¡ÃƒÆ’Ã†â€™Ãƒâ€ Ã¢â‚¬â„¢ÃƒÆ’Ã‚Â¢ÃƒÂ¢Ã¢â‚¬Å¡Ã‚Â¬Ãƒâ€¦Ã‚Â¡ÃƒÆ’Ã†â€™ÃƒÂ¢Ã¢â€šÂ¬Ã…Â¡ÃƒÆ’Ã¢â‚¬Å¡Ãƒâ€šÃ‚Â°C at the beginning to a minimum of around 25.6ÃƒÆ’Ã†â€™Ãƒâ€ Ã¢â‚¬â„¢ÃƒÆ’Ã¢â‚¬Â ÃƒÂ¢Ã¢â€šÂ¬Ã¢â€žÂ¢ÃƒÆ’Ã†â€™ÃƒÂ¢Ã¢â€šÂ¬Ã‚Â ÃƒÆ’Ã‚Â¢ÃƒÂ¢Ã¢â‚¬Å¡Ã‚Â¬ÃƒÂ¢Ã¢â‚¬Å¾Ã‚Â¢ÃƒÆ’Ã†â€™Ãƒâ€ Ã¢â‚¬â„¢ÃƒÆ’Ã‚Â¢ÃƒÂ¢Ã¢â‚¬Å¡Ã‚Â¬Ãƒâ€šÃ‚Â ÃƒÆ’Ã†â€™Ãƒâ€šÃ‚Â¢ÃƒÆ’Ã‚Â¢ÃƒÂ¢Ã¢â€šÂ¬Ã…Â¡Ãƒâ€šÃ‚Â¬ÃƒÆ’Ã‚Â¢ÃƒÂ¢Ã¢â€šÂ¬Ã…Â¾Ãƒâ€šÃ‚Â¢ÃƒÆ’Ã†â€™Ãƒâ€ Ã¢â‚¬â„¢ÃƒÆ’Ã¢â‚¬Â ÃƒÂ¢Ã¢â€šÂ¬Ã¢â€žÂ¢ÃƒÆ’Ã†â€™Ãƒâ€šÃ‚Â¢ÃƒÆ’Ã‚Â¢ÃƒÂ¢Ã¢â€šÂ¬Ã…Â¡Ãƒâ€šÃ‚Â¬ÃƒÆ’Ã¢â‚¬Å¡Ãƒâ€šÃ‚Â ÃƒÆ’Ã†â€™Ãƒâ€ Ã¢â‚¬â„¢ÃƒÆ’Ã¢â‚¬Å¡Ãƒâ€šÃ‚Â¢ÃƒÆ’Ã†â€™Ãƒâ€šÃ‚Â¢ÃƒÆ’Ã‚Â¢ÃƒÂ¢Ã¢â‚¬Å¡Ã‚Â¬Ãƒâ€¦Ã‚Â¡ÃƒÆ’Ã¢â‚¬Å¡Ãƒâ€šÃ‚Â¬ÃƒÆ’Ã†â€™Ãƒâ€šÃ‚Â¢ÃƒÆ’Ã‚Â¢ÃƒÂ¢Ã¢â‚¬Å¡Ã‚Â¬Ãƒâ€¦Ã‚Â¾ÃƒÆ’Ã¢â‚¬Å¡Ãƒâ€šÃ‚Â¢ÃƒÆ’Ã†â€™Ãƒâ€ Ã¢â‚¬â„¢ÃƒÆ’Ã¢â‚¬Â ÃƒÂ¢Ã¢â€šÂ¬Ã¢â€žÂ¢ÃƒÆ’Ã†â€™ÃƒÂ¢Ã¢â€šÂ¬Ã‚Â ÃƒÆ’Ã‚Â¢ÃƒÂ¢Ã¢â‚¬Å¡Ã‚Â¬ÃƒÂ¢Ã¢â‚¬Å¾Ã‚Â¢ÃƒÆ’Ã†â€™Ãƒâ€ Ã¢â‚¬â„¢ÃƒÆ’Ã¢â‚¬Å¡Ãƒâ€šÃ‚Â¢ÃƒÆ’Ã†â€™Ãƒâ€šÃ‚Â¢ÃƒÆ’Ã‚Â¢ÃƒÂ¢Ã¢â‚¬Å¡Ã‚Â¬Ãƒâ€¦Ã‚Â¡ÃƒÆ’Ã¢â‚¬Å¡Ãƒâ€šÃ‚Â¬ÃƒÆ’Ã†â€™ÃƒÂ¢Ã¢â€šÂ¬Ã…Â¡ÃƒÆ’Ã¢â‚¬Å¡Ãƒâ€šÃ‚Â ÃƒÆ’Ã†â€™Ãƒâ€ Ã¢â‚¬â„¢ÃƒÆ’Ã¢â‚¬Â ÃƒÂ¢Ã¢â€šÂ¬Ã¢â€žÂ¢ÃƒÆ’Ã†â€™ÃƒÂ¢Ã¢â€šÂ¬Ã…Â¡ÃƒÆ’Ã¢â‚¬Å¡Ãƒâ€šÃ‚Â¢ÃƒÆ’Ã†â€™Ãƒâ€ Ã¢â‚¬â„¢ÃƒÆ’Ã¢â‚¬Å¡Ãƒâ€šÃ‚Â¢ÃƒÆ’Ã†â€™Ãƒâ€šÃ‚Â¢ÃƒÆ’Ã‚Â¢ÃƒÂ¢Ã¢â€šÂ¬Ã…Â¡Ãƒâ€šÃ‚Â¬ÃƒÆ’Ã¢â‚¬Â¦Ãƒâ€šÃ‚Â¡ÃƒÆ’Ã†â€™ÃƒÂ¢Ã¢â€šÂ¬Ã…Â¡ÃƒÆ’Ã¢â‚¬Å¡Ãƒâ€šÃ‚Â¬ÃƒÆ’Ã†â€™Ãƒâ€ Ã¢â‚¬â„¢ÃƒÆ’Ã¢â‚¬Å¡Ãƒâ€šÃ‚Â¢ÃƒÆ’Ã†â€™Ãƒâ€šÃ‚Â¢ÃƒÆ’Ã‚Â¢ÃƒÂ¢Ã¢â€šÂ¬Ã…Â¡Ãƒâ€šÃ‚Â¬ÃƒÆ’Ã¢â‚¬Â¦Ãƒâ€šÃ‚Â¾ÃƒÆ’Ã†â€™ÃƒÂ¢Ã¢â€šÂ¬Ã…Â¡ÃƒÆ’Ã¢â‚¬Å¡Ãƒâ€šÃ‚Â¢ÃƒÆ’Ã†â€™Ãƒâ€ Ã¢â‚¬â„¢ÃƒÆ’Ã¢â‚¬Â ÃƒÂ¢Ã¢â€šÂ¬Ã¢â€žÂ¢ÃƒÆ’Ã†â€™ÃƒÂ¢Ã¢â€šÂ¬Ã‚Â ÃƒÆ’Ã‚Â¢ÃƒÂ¢Ã¢â‚¬Å¡Ã‚Â¬ÃƒÂ¢Ã¢â‚¬Å¾Ã‚Â¢ÃƒÆ’Ã†â€™Ãƒâ€ Ã¢â‚¬â„¢ÃƒÆ’Ã‚Â¢ÃƒÂ¢Ã¢â‚¬Å¡Ã‚Â¬Ãƒâ€šÃ‚Â ÃƒÆ’Ã†â€™Ãƒâ€šÃ‚Â¢ÃƒÆ’Ã‚Â¢ÃƒÂ¢Ã¢â€šÂ¬Ã…Â¡Ãƒâ€šÃ‚Â¬ÃƒÆ’Ã‚Â¢ÃƒÂ¢Ã¢â€šÂ¬Ã…Â¾Ãƒâ€šÃ‚Â¢ÃƒÆ’Ã†â€™Ãƒâ€ Ã¢â‚¬â„¢ÃƒÆ’Ã¢â‚¬Â ÃƒÂ¢Ã¢â€šÂ¬Ã¢â€žÂ¢ÃƒÆ’Ã†â€™ÃƒÂ¢Ã¢â€šÂ¬Ã…Â¡ÃƒÆ’Ã¢â‚¬Å¡Ãƒâ€šÃ‚Â¢ÃƒÆ’Ã†â€™Ãƒâ€ Ã¢â‚¬â„¢ÃƒÆ’Ã¢â‚¬Å¡Ãƒâ€šÃ‚Â¢ÃƒÆ’Ã†â€™Ãƒâ€šÃ‚Â¢ÃƒÆ’Ã‚Â¢ÃƒÂ¢Ã¢â€šÂ¬Ã…Â¡Ãƒâ€šÃ‚Â¬ÃƒÆ’Ã¢â‚¬Â¦Ãƒâ€šÃ‚Â¡ÃƒÆ’Ã†â€™ÃƒÂ¢Ã¢â€šÂ¬Ã…Â¡ÃƒÆ’Ã¢â‚¬Å¡Ãƒâ€šÃ‚Â¬ÃƒÆ’Ã†â€™Ãƒâ€ Ã¢â‚¬â„¢ÃƒÆ’Ã‚Â¢ÃƒÂ¢Ã¢â‚¬Å¡Ã‚Â¬Ãƒâ€šÃ‚Â¦ÃƒÆ’Ã†â€™ÃƒÂ¢Ã¢â€šÂ¬Ã…Â¡ÃƒÆ’Ã¢â‚¬Å¡Ãƒâ€šÃ‚Â¡ÃƒÆ’Ã†â€™Ãƒâ€ Ã¢â‚¬â„¢ÃƒÆ’Ã¢â‚¬Â ÃƒÂ¢Ã¢â€šÂ¬Ã¢â€žÂ¢ÃƒÆ’Ã†â€™ÃƒÂ¢Ã¢â€šÂ¬Ã‚Â ÃƒÆ’Ã‚Â¢ÃƒÂ¢Ã¢â‚¬Å¡Ã‚Â¬ÃƒÂ¢Ã¢â‚¬Å¾Ã‚Â¢ÃƒÆ’Ã†â€™Ãƒâ€ Ã¢â‚¬â„¢ÃƒÆ’Ã¢â‚¬Å¡Ãƒâ€šÃ‚Â¢ÃƒÆ’Ã†â€™Ãƒâ€šÃ‚Â¢ÃƒÆ’Ã‚Â¢ÃƒÂ¢Ã¢â‚¬Å¡Ã‚Â¬Ãƒâ€¦Ã‚Â¡ÃƒÆ’Ã¢â‚¬Å¡Ãƒâ€šÃ‚Â¬ÃƒÆ’Ã†â€™ÃƒÂ¢Ã¢â€šÂ¬Ã‚Â¦ÃƒÆ’Ã¢â‚¬Å¡Ãƒâ€šÃ‚Â¡ÃƒÆ’Ã†â€™Ãƒâ€ Ã¢â‚¬â„¢ÃƒÆ’Ã¢â‚¬Â ÃƒÂ¢Ã¢â€šÂ¬Ã¢â€žÂ¢ÃƒÆ’Ã†â€™Ãƒâ€šÃ‚Â¢ÃƒÆ’Ã‚Â¢ÃƒÂ¢Ã¢â€šÂ¬Ã…Â¡Ãƒâ€šÃ‚Â¬ÃƒÆ’Ã¢â‚¬Â¦Ãƒâ€šÃ‚Â¡ÃƒÆ’Ã†â€™Ãƒâ€ Ã¢â‚¬â„¢ÃƒÆ’Ã‚Â¢ÃƒÂ¢Ã¢â‚¬Å¡Ã‚Â¬Ãƒâ€¦Ã‚Â¡ÃƒÆ’Ã†â€™ÃƒÂ¢Ã¢â€šÂ¬Ã…Â¡ÃƒÆ’Ã¢â‚¬Å¡Ãƒâ€šÃ‚Â¢ÃƒÆ’Ã†â€™Ãƒâ€ Ã¢â‚¬â„¢ÃƒÆ’Ã¢â‚¬Â ÃƒÂ¢Ã¢â€šÂ¬Ã¢â€žÂ¢ÃƒÆ’Ã†â€™ÃƒÂ¢Ã¢â€šÂ¬Ã‚Â ÃƒÆ’Ã‚Â¢ÃƒÂ¢Ã¢â‚¬Å¡Ã‚Â¬ÃƒÂ¢Ã¢â‚¬Å¾Ã‚Â¢ÃƒÆ’Ã†â€™Ãƒâ€ Ã¢â‚¬â„¢ÃƒÆ’Ã‚Â¢ÃƒÂ¢Ã¢â‚¬Å¡Ã‚Â¬Ãƒâ€šÃ‚Â ÃƒÆ’Ã†â€™Ãƒâ€šÃ‚Â¢ÃƒÆ’Ã‚Â¢ÃƒÂ¢Ã¢â€šÂ¬Ã…Â¡Ãƒâ€šÃ‚Â¬ÃƒÆ’Ã‚Â¢ÃƒÂ¢Ã¢â€šÂ¬Ã…Â¾Ãƒâ€šÃ‚Â¢ÃƒÆ’Ã†â€™Ãƒâ€ Ã¢â‚¬â„¢ÃƒÆ’Ã¢â‚¬Â ÃƒÂ¢Ã¢â€šÂ¬Ã¢â€žÂ¢ÃƒÆ’Ã†â€™Ãƒâ€šÃ‚Â¢ÃƒÆ’Ã‚Â¢ÃƒÂ¢Ã¢â€šÂ¬Ã…Â¡Ãƒâ€šÃ‚Â¬ÃƒÆ’Ã¢â‚¬Å¡Ãƒâ€šÃ‚Â ÃƒÆ’Ã†â€™Ãƒâ€ Ã¢â‚¬â„¢ÃƒÆ’Ã¢â‚¬Å¡Ãƒâ€šÃ‚Â¢ÃƒÆ’Ã†â€™Ãƒâ€šÃ‚Â¢ÃƒÆ’Ã‚Â¢ÃƒÂ¢Ã¢â‚¬Å¡Ã‚Â¬Ãƒâ€¦Ã‚Â¡ÃƒÆ’Ã¢â‚¬Å¡Ãƒâ€šÃ‚Â¬ÃƒÆ’Ã†â€™Ãƒâ€šÃ‚Â¢ÃƒÆ’Ã‚Â¢ÃƒÂ¢Ã¢â‚¬Å¡Ã‚Â¬Ãƒâ€¦Ã‚Â¾ÃƒÆ’Ã¢â‚¬Å¡Ãƒâ€šÃ‚Â¢ÃƒÆ’Ã†â€™Ãƒâ€ Ã¢â‚¬â„¢ÃƒÆ’Ã¢â‚¬Â ÃƒÂ¢Ã¢â€šÂ¬Ã¢â€žÂ¢ÃƒÆ’Ã†â€™ÃƒÂ¢Ã¢â€šÂ¬Ã‚Â ÃƒÆ’Ã‚Â¢ÃƒÂ¢Ã¢â‚¬Å¡Ã‚Â¬ÃƒÂ¢Ã¢â‚¬Å¾Ã‚Â¢ÃƒÆ’Ã†â€™Ãƒâ€ Ã¢â‚¬â„¢ÃƒÆ’Ã¢â‚¬Å¡Ãƒâ€šÃ‚Â¢ÃƒÆ’Ã†â€™Ãƒâ€šÃ‚Â¢ÃƒÆ’Ã‚Â¢ÃƒÂ¢Ã¢â‚¬Å¡Ã‚Â¬Ãƒâ€¦Ã‚Â¡ÃƒÆ’Ã¢â‚¬Å¡Ãƒâ€šÃ‚Â¬ÃƒÆ’Ã†â€™ÃƒÂ¢Ã¢â€šÂ¬Ã‚Â¦ÃƒÆ’Ã¢â‚¬Å¡Ãƒâ€šÃ‚Â¡ÃƒÆ’Ã†â€™Ãƒâ€ Ã¢â‚¬â„¢ÃƒÆ’Ã¢â‚¬Â ÃƒÂ¢Ã¢â€šÂ¬Ã¢â€žÂ¢ÃƒÆ’Ã†â€™Ãƒâ€šÃ‚Â¢ÃƒÆ’Ã‚Â¢ÃƒÂ¢Ã¢â€šÂ¬Ã…Â¡Ãƒâ€šÃ‚Â¬ÃƒÆ’Ã¢â‚¬Â¦Ãƒâ€šÃ‚Â¡ÃƒÆ’Ã†â€™Ãƒâ€ Ã¢â‚¬â„¢ÃƒÆ’Ã‚Â¢ÃƒÂ¢Ã¢â‚¬Å¡Ã‚Â¬Ãƒâ€¦Ã‚Â¡ÃƒÆ’Ã†â€™ÃƒÂ¢Ã¢â€šÂ¬Ã…Â¡ÃƒÆ’Ã¢â‚¬Å¡Ãƒâ€šÃ‚Â¢ÃƒÆ’Ã†â€™Ãƒâ€ Ã¢â‚¬â„¢ÃƒÆ’Ã¢â‚¬Â ÃƒÂ¢Ã¢â€šÂ¬Ã¢â€žÂ¢ÃƒÆ’Ã†â€™ÃƒÂ¢Ã¢â€šÂ¬Ã‚Â ÃƒÆ’Ã‚Â¢ÃƒÂ¢Ã¢â‚¬Å¡Ã‚Â¬ÃƒÂ¢Ã¢â‚¬Å¾Ã‚Â¢ÃƒÆ’Ã†â€™Ãƒâ€ Ã¢â‚¬â„¢ÃƒÆ’Ã‚Â¢ÃƒÂ¢Ã¢â‚¬Å¡Ã‚Â¬Ãƒâ€šÃ‚Â ÃƒÆ’Ã†â€™Ãƒâ€šÃ‚Â¢ÃƒÆ’Ã‚Â¢ÃƒÂ¢Ã¢â€šÂ¬Ã…Â¡Ãƒâ€šÃ‚Â¬ÃƒÆ’Ã‚Â¢ÃƒÂ¢Ã¢â€šÂ¬Ã…Â¾Ãƒâ€šÃ‚Â¢ÃƒÆ’Ã†â€™Ãƒâ€ Ã¢â‚¬â„¢ÃƒÆ’Ã¢â‚¬Â ÃƒÂ¢Ã¢â€šÂ¬Ã¢â€žÂ¢ÃƒÆ’Ã†â€™Ãƒâ€šÃ‚Â¢ÃƒÆ’Ã‚Â¢ÃƒÂ¢Ã¢â€šÂ¬Ã…Â¡Ãƒâ€šÃ‚Â¬ÃƒÆ’Ã¢â‚¬Â¦Ãƒâ€šÃ‚Â¡ÃƒÆ’Ã†â€™Ãƒâ€ Ã¢â‚¬â„¢ÃƒÆ’Ã‚Â¢ÃƒÂ¢Ã¢â‚¬Å¡Ã‚Â¬Ãƒâ€¦Ã‚Â¡ÃƒÆ’Ã†â€™ÃƒÂ¢Ã¢â€šÂ¬Ã…Â¡ÃƒÆ’Ã¢â‚¬Å¡Ãƒâ€šÃ‚Â¢ÃƒÆ’Ã†â€™Ãƒâ€ Ã¢â‚¬â„¢ÃƒÆ’Ã¢â‚¬Â ÃƒÂ¢Ã¢â€šÂ¬Ã¢â€žÂ¢ÃƒÆ’Ã†â€™ÃƒÂ¢Ã¢â€šÂ¬Ã‚Â ÃƒÆ’Ã‚Â¢ÃƒÂ¢Ã¢â‚¬Å¡Ã‚Â¬ÃƒÂ¢Ã¢â‚¬Å¾Ã‚Â¢ÃƒÆ’Ã†â€™Ãƒâ€ Ã¢â‚¬â„¢ÃƒÆ’Ã‚Â¢ÃƒÂ¢Ã¢â‚¬Å¡Ã‚Â¬Ãƒâ€¦Ã‚Â¡ÃƒÆ’Ã†â€™ÃƒÂ¢Ã¢â€šÂ¬Ã…Â¡ÃƒÆ’Ã¢â‚¬Å¡Ãƒâ€šÃ‚Â¢ÃƒÆ’Ã†â€™Ãƒâ€ Ã¢â‚¬â„¢ÃƒÆ’Ã¢â‚¬Â ÃƒÂ¢Ã¢â€šÂ¬Ã¢â€žÂ¢ÃƒÆ’Ã†â€™ÃƒÂ¢Ã¢â€šÂ¬Ã…Â¡ÃƒÆ’Ã¢â‚¬Å¡Ãƒâ€šÃ‚Â¢ÃƒÆ’Ã†â€™Ãƒâ€ Ã¢â‚¬â„¢ÃƒÆ’Ã¢â‚¬Å¡Ãƒâ€šÃ‚Â¢ÃƒÆ’Ã†â€™Ãƒâ€šÃ‚Â¢ÃƒÆ’Ã‚Â¢ÃƒÂ¢Ã¢â€šÂ¬Ã…Â¡Ãƒâ€šÃ‚Â¬ÃƒÆ’Ã¢â‚¬Â¦Ãƒâ€šÃ‚Â¡ÃƒÆ’Ã†â€™ÃƒÂ¢Ã¢â€šÂ¬Ã…Â¡ÃƒÆ’Ã¢â‚¬Å¡Ãƒâ€šÃ‚Â¬ÃƒÆ’Ã†â€™Ãƒâ€ Ã¢â‚¬â„¢ÃƒÆ’Ã‚Â¢ÃƒÂ¢Ã¢â‚¬Å¡Ã‚Â¬Ãƒâ€šÃ‚Â¦ÃƒÆ’Ã†â€™ÃƒÂ¢Ã¢â€šÂ¬Ã…Â¡ÃƒÆ’Ã¢â‚¬Å¡Ãƒâ€šÃ‚Â¡ÃƒÆ’Ã†â€™Ãƒâ€ Ã¢â‚¬â„¢ÃƒÆ’Ã¢â‚¬Â ÃƒÂ¢Ã¢â€šÂ¬Ã¢â€žÂ¢ÃƒÆ’Ã†â€™Ãƒâ€šÃ‚Â¢ÃƒÆ’Ã‚Â¢ÃƒÂ¢Ã¢â€šÂ¬Ã…Â¡Ãƒâ€šÃ‚Â¬ÃƒÆ’Ã¢â‚¬Â¦Ãƒâ€šÃ‚Â¡ÃƒÆ’Ã†â€™Ãƒâ€ Ã¢â‚¬â„¢ÃƒÆ’Ã‚Â¢ÃƒÂ¢Ã¢â‚¬Å¡Ã‚Â¬Ãƒâ€¦Ã‚Â¡ÃƒÆ’Ã†â€™ÃƒÂ¢Ã¢â€šÂ¬Ã…Â¡ÃƒÆ’Ã¢â‚¬Å¡Ãƒâ€šÃ‚Â¬ÃƒÆ’Ã†â€™Ãƒâ€ Ã¢â‚¬â„¢ÃƒÆ’Ã¢â‚¬Â ÃƒÂ¢Ã¢â€šÂ¬Ã¢â€žÂ¢ÃƒÆ’Ã†â€™ÃƒÂ¢Ã¢â€šÂ¬Ã‚Â ÃƒÆ’Ã‚Â¢ÃƒÂ¢Ã¢â‚¬Å¡Ã‚Â¬ÃƒÂ¢Ã¢â‚¬Å¾Ã‚Â¢ÃƒÆ’Ã†â€™Ãƒâ€ Ã¢â‚¬â„¢ÃƒÆ’Ã¢â‚¬Å¡Ãƒâ€šÃ‚Â¢ÃƒÆ’Ã†â€™Ãƒâ€šÃ‚Â¢ÃƒÆ’Ã‚Â¢ÃƒÂ¢Ã¢â‚¬Å¡Ã‚Â¬Ãƒâ€¦Ã‚Â¡ÃƒÆ’Ã¢â‚¬Å¡Ãƒâ€šÃ‚Â¬ÃƒÆ’Ã†â€™ÃƒÂ¢Ã¢â€šÂ¬Ã…Â¡ÃƒÆ’Ã¢â‚¬Å¡Ãƒâ€šÃ‚Â¦ÃƒÆ’Ã†â€™Ãƒâ€ Ã¢â‚¬â„¢ÃƒÆ’Ã¢â‚¬Â ÃƒÂ¢Ã¢â€šÂ¬Ã¢â€žÂ¢ÃƒÆ’Ã†â€™Ãƒâ€šÃ‚Â¢ÃƒÆ’Ã‚Â¢ÃƒÂ¢Ã¢â€šÂ¬Ã…Â¡Ãƒâ€šÃ‚Â¬ÃƒÆ’Ã¢â‚¬Â¦Ãƒâ€šÃ‚Â¡ÃƒÆ’Ã†â€™Ãƒâ€ Ã¢â‚¬â„¢ÃƒÆ’Ã‚Â¢ÃƒÂ¢Ã¢â‚¬Å¡Ã‚Â¬Ãƒâ€¦Ã‚Â¡ÃƒÆ’Ã†â€™ÃƒÂ¢Ã¢â€šÂ¬Ã…Â¡ÃƒÆ’Ã¢â‚¬Å¡Ãƒâ€šÃ‚Â¡ÃƒÆ’Ã†â€™Ãƒâ€ Ã¢â‚¬â„¢ÃƒÆ’Ã¢â‚¬Â ÃƒÂ¢Ã¢â€šÂ¬Ã¢â€žÂ¢ÃƒÆ’Ã†â€™ÃƒÂ¢Ã¢â€šÂ¬Ã‚Â ÃƒÆ’Ã‚Â¢ÃƒÂ¢Ã¢â‚¬Å¡Ã‚Â¬ÃƒÂ¢Ã¢â‚¬Å¾Ã‚Â¢ÃƒÆ’Ã†â€™Ãƒâ€ Ã¢â‚¬â„¢ÃƒÆ’Ã‚Â¢ÃƒÂ¢Ã¢â‚¬Å¡Ã‚Â¬Ãƒâ€šÃ‚Â ÃƒÆ’Ã†â€™Ãƒâ€šÃ‚Â¢ÃƒÆ’Ã‚Â¢ÃƒÂ¢Ã¢â€šÂ¬Ã…Â¡Ãƒâ€šÃ‚Â¬ÃƒÆ’Ã‚Â¢ÃƒÂ¢Ã¢â€šÂ¬Ã…Â¾Ãƒâ€šÃ‚Â¢ÃƒÆ’Ã†â€™Ãƒâ€ Ã¢â‚¬â„¢ÃƒÆ’Ã¢â‚¬Â ÃƒÂ¢Ã¢â€šÂ¬Ã¢â€žÂ¢ÃƒÆ’Ã†â€™ÃƒÂ¢Ã¢â€šÂ¬Ã…Â¡ÃƒÆ’Ã¢â‚¬Å¡Ãƒâ€šÃ‚Â¢ÃƒÆ’Ã†â€™Ãƒâ€ Ã¢â‚¬â„¢ÃƒÆ’Ã¢â‚¬Å¡Ãƒâ€šÃ‚Â¢ÃƒÆ’Ã†â€™Ãƒâ€šÃ‚Â¢ÃƒÆ’Ã‚Â¢ÃƒÂ¢Ã¢â€šÂ¬Ã…Â¡Ãƒâ€šÃ‚Â¬ÃƒÆ’Ã¢â‚¬Â¦Ãƒâ€šÃ‚Â¡ÃƒÆ’Ã†â€™ÃƒÂ¢Ã¢â€šÂ¬Ã…Â¡ÃƒÆ’Ã¢â‚¬Å¡Ãƒâ€šÃ‚Â¬ÃƒÆ’Ã†â€™Ãƒâ€ Ã¢â‚¬â„¢ÃƒÆ’Ã‚Â¢ÃƒÂ¢Ã¢â‚¬Å¡Ã‚Â¬Ãƒâ€šÃ‚Â¦ÃƒÆ’Ã†â€™ÃƒÂ¢Ã¢â€šÂ¬Ã…Â¡ÃƒÆ’Ã¢â‚¬Å¡Ãƒâ€šÃ‚Â¡ÃƒÆ’Ã†â€™Ãƒâ€ Ã¢â‚¬â„¢ÃƒÆ’Ã¢â‚¬Â ÃƒÂ¢Ã¢â€šÂ¬Ã¢â€žÂ¢ÃƒÆ’Ã†â€™ÃƒÂ¢Ã¢â€šÂ¬Ã‚Â ÃƒÆ’Ã‚Â¢ÃƒÂ¢Ã¢â‚¬Å¡Ã‚Â¬ÃƒÂ¢Ã¢â‚¬Å¾Ã‚Â¢ÃƒÆ’Ã†â€™Ãƒâ€ Ã¢â‚¬â„¢ÃƒÆ’Ã¢â‚¬Å¡Ãƒâ€šÃ‚Â¢ÃƒÆ’Ã†â€™Ãƒâ€šÃ‚Â¢ÃƒÆ’Ã‚Â¢ÃƒÂ¢Ã¢â‚¬Å¡Ã‚Â¬Ãƒâ€¦Ã‚Â¡ÃƒÆ’Ã¢â‚¬Å¡Ãƒâ€šÃ‚Â¬ÃƒÆ’Ã†â€™ÃƒÂ¢Ã¢â€šÂ¬Ã‚Â¦ÃƒÆ’Ã¢â‚¬Å¡Ãƒâ€šÃ‚Â¡ÃƒÆ’Ã†â€™Ãƒâ€ Ã¢â‚¬â„¢ÃƒÆ’Ã¢â‚¬Â ÃƒÂ¢Ã¢â€šÂ¬Ã¢â€žÂ¢ÃƒÆ’Ã†â€™Ãƒâ€šÃ‚Â¢ÃƒÆ’Ã‚Â¢ÃƒÂ¢Ã¢â€šÂ¬Ã…Â¡Ãƒâ€šÃ‚Â¬ÃƒÆ’Ã¢â‚¬Â¦Ãƒâ€šÃ‚Â¡ÃƒÆ’Ã†â€™Ãƒâ€ Ã¢â‚¬â„¢ÃƒÆ’Ã‚Â¢ÃƒÂ¢Ã¢â‚¬Å¡Ã‚Â¬Ãƒâ€¦Ã‚Â¡ÃƒÆ’Ã†â€™ÃƒÂ¢Ã¢â€šÂ¬Ã…Â¡ÃƒÆ’Ã¢â‚¬Å¡Ãƒâ€šÃ‚Â¬ÃƒÆ’Ã†â€™Ãƒâ€ Ã¢â‚¬â„¢ÃƒÆ’Ã¢â‚¬Â ÃƒÂ¢Ã¢â€šÂ¬Ã¢â€žÂ¢ÃƒÆ’Ã†â€™ÃƒÂ¢Ã¢â€šÂ¬Ã‚Â ÃƒÆ’Ã‚Â¢ÃƒÂ¢Ã¢â‚¬Å¡Ã‚Â¬ÃƒÂ¢Ã¢â‚¬Å¾Ã‚Â¢ÃƒÆ’Ã†â€™Ãƒâ€ Ã¢â‚¬â„¢ÃƒÆ’Ã‚Â¢ÃƒÂ¢Ã¢â‚¬Å¡Ã‚Â¬Ãƒâ€šÃ‚Â ÃƒÆ’Ã†â€™Ãƒâ€šÃ‚Â¢ÃƒÆ’Ã‚Â¢ÃƒÂ¢Ã¢â€šÂ¬Ã…Â¡Ãƒâ€šÃ‚Â¬ÃƒÆ’Ã‚Â¢ÃƒÂ¢Ã¢â€šÂ¬Ã…Â¾Ãƒâ€šÃ‚Â¢ÃƒÆ’Ã†â€™Ãƒâ€ Ã¢â‚¬â„¢ÃƒÆ’Ã¢â‚¬Â ÃƒÂ¢Ã¢â€šÂ¬Ã¢â€žÂ¢ÃƒÆ’Ã†â€™Ãƒâ€šÃ‚Â¢ÃƒÆ’Ã‚Â¢ÃƒÂ¢Ã¢â€šÂ¬Ã…Â¡Ãƒâ€šÃ‚Â¬ÃƒÆ’Ã¢â‚¬Å¡Ãƒâ€šÃ‚Â ÃƒÆ’Ã†â€™Ãƒâ€ Ã¢â‚¬â„¢ÃƒÆ’Ã¢â‚¬Å¡Ãƒâ€šÃ‚Â¢ÃƒÆ’Ã†â€™Ãƒâ€šÃ‚Â¢ÃƒÆ’Ã‚Â¢ÃƒÂ¢Ã¢â‚¬Å¡Ã‚Â¬Ãƒâ€¦Ã‚Â¡ÃƒÆ’Ã¢â‚¬Å¡Ãƒâ€šÃ‚Â¬ÃƒÆ’Ã†â€™Ãƒâ€šÃ‚Â¢ÃƒÆ’Ã‚Â¢ÃƒÂ¢Ã¢â‚¬Å¡Ã‚Â¬Ãƒâ€¦Ã‚Â¾ÃƒÆ’Ã¢â‚¬Å¡Ãƒâ€šÃ‚Â¢ÃƒÆ’Ã†â€™Ãƒâ€ Ã¢â‚¬â„¢ÃƒÆ’Ã¢â‚¬Â ÃƒÂ¢Ã¢â€šÂ¬Ã¢â€žÂ¢ÃƒÆ’Ã†â€™ÃƒÂ¢Ã¢â€šÂ¬Ã‚Â ÃƒÆ’Ã‚Â¢ÃƒÂ¢Ã¢â‚¬Å¡Ã‚Â¬ÃƒÂ¢Ã¢â‚¬Å¾Ã‚Â¢ÃƒÆ’Ã†â€™Ãƒâ€ Ã¢â‚¬â„¢ÃƒÆ’Ã¢â‚¬Å¡Ãƒâ€šÃ‚Â¢ÃƒÆ’Ã†â€™Ãƒâ€šÃ‚Â¢ÃƒÆ’Ã‚Â¢ÃƒÂ¢Ã¢â‚¬Å¡Ã‚Â¬Ãƒâ€¦Ã‚Â¡ÃƒÆ’Ã¢â‚¬Å¡Ãƒâ€šÃ‚Â¬ÃƒÆ’Ã†â€™ÃƒÂ¢Ã¢â€šÂ¬Ã‚Â¦ÃƒÆ’Ã¢â‚¬Å¡Ãƒâ€šÃ‚Â¡ÃƒÆ’Ã†â€™Ãƒâ€ Ã¢â‚¬â„¢ÃƒÆ’Ã¢â‚¬Â ÃƒÂ¢Ã¢â€šÂ¬Ã¢â€žÂ¢ÃƒÆ’Ã†â€™Ãƒâ€šÃ‚Â¢ÃƒÆ’Ã‚Â¢ÃƒÂ¢Ã¢â€šÂ¬Ã…Â¡Ãƒâ€šÃ‚Â¬ÃƒÆ’Ã¢â‚¬Â¦Ãƒâ€šÃ‚Â¡ÃƒÆ’Ã†â€™Ãƒâ€ Ã¢â‚¬â„¢ÃƒÆ’Ã‚Â¢ÃƒÂ¢Ã¢â‚¬Å¡Ã‚Â¬Ãƒâ€¦Ã‚Â¡ÃƒÆ’Ã†â€™ÃƒÂ¢Ã¢â€šÂ¬Ã…Â¡ÃƒÆ’Ã¢â‚¬Å¡Ãƒâ€šÃ‚Â¢ÃƒÆ’Ã†â€™Ãƒâ€ Ã¢â‚¬â„¢ÃƒÆ’Ã¢â‚¬Â ÃƒÂ¢Ã¢â€šÂ¬Ã¢â€žÂ¢ÃƒÆ’Ã†â€™ÃƒÂ¢Ã¢â€šÂ¬Ã‚Â ÃƒÆ’Ã‚Â¢ÃƒÂ¢Ã¢â‚¬Å¡Ã‚Â¬ÃƒÂ¢Ã¢â‚¬Å¾Ã‚Â¢ÃƒÆ’Ã†â€™Ãƒâ€ Ã¢â‚¬â„¢ÃƒÆ’Ã‚Â¢ÃƒÂ¢Ã¢â‚¬Å¡Ã‚Â¬Ãƒâ€šÃ‚Â ÃƒÆ’Ã†â€™Ãƒâ€šÃ‚Â¢ÃƒÆ’Ã‚Â¢ÃƒÂ¢Ã¢â€šÂ¬Ã…Â¡Ãƒâ€šÃ‚Â¬ÃƒÆ’Ã‚Â¢ÃƒÂ¢Ã¢â€šÂ¬Ã…Â¾Ãƒâ€šÃ‚Â¢ÃƒÆ’Ã†â€™Ãƒâ€ Ã¢â‚¬â„¢ÃƒÆ’Ã¢â‚¬Â ÃƒÂ¢Ã¢â€šÂ¬Ã¢â€žÂ¢ÃƒÆ’Ã†â€™Ãƒâ€šÃ‚Â¢ÃƒÆ’Ã‚Â¢ÃƒÂ¢Ã¢â€šÂ¬Ã…Â¡Ãƒâ€šÃ‚Â¬ÃƒÆ’Ã¢â‚¬Â¦Ãƒâ€šÃ‚Â¡ÃƒÆ’Ã†â€™Ãƒâ€ Ã¢â‚¬â„¢ÃƒÆ’Ã‚Â¢ÃƒÂ¢Ã¢â‚¬Å¡Ã‚Â¬Ãƒâ€¦Ã‚Â¡ÃƒÆ’Ã†â€™ÃƒÂ¢Ã¢â€šÂ¬Ã…Â¡ÃƒÆ’Ã¢â‚¬Å¡Ãƒâ€šÃ‚Â¢ÃƒÆ’Ã†â€™Ãƒâ€ Ã¢â‚¬â„¢ÃƒÆ’Ã¢â‚¬Â ÃƒÂ¢Ã¢â€šÂ¬Ã¢â€žÂ¢ÃƒÆ’Ã†â€™ÃƒÂ¢Ã¢â€šÂ¬Ã‚Â ÃƒÆ’Ã‚Â¢ÃƒÂ¢Ã¢â‚¬Å¡Ã‚Â¬ÃƒÂ¢Ã¢â‚¬Å¾Ã‚Â¢ÃƒÆ’Ã†â€™Ãƒâ€ Ã¢â‚¬â„¢ÃƒÆ’Ã‚Â¢ÃƒÂ¢Ã¢â‚¬Å¡Ã‚Â¬Ãƒâ€¦Ã‚Â¡ÃƒÆ’Ã†â€™ÃƒÂ¢Ã¢â€šÂ¬Ã…Â¡ÃƒÆ’Ã¢â‚¬Å¡Ãƒâ€šÃ‚Â¢ÃƒÆ’Ã†â€™Ãƒâ€ Ã¢â‚¬â„¢ÃƒÆ’Ã¢â‚¬Â ÃƒÂ¢Ã¢â€šÂ¬Ã¢â€žÂ¢ÃƒÆ’Ã†â€™ÃƒÂ¢Ã¢â€šÂ¬Ã…Â¡ÃƒÆ’Ã¢â‚¬Å¡Ãƒâ€šÃ‚Â¢ÃƒÆ’Ã†â€™Ãƒâ€ Ã¢â‚¬â„¢ÃƒÆ’Ã¢â‚¬Å¡Ãƒâ€šÃ‚Â¢ÃƒÆ’Ã†â€™Ãƒâ€šÃ‚Â¢ÃƒÆ’Ã‚Â¢ÃƒÂ¢Ã¢â‚¬Å¡Ã‚Â¬Ãƒâ€¦Ã‚Â¡ÃƒÆ’Ã¢â‚¬Å¡Ãƒâ€šÃ‚Â¬ÃƒÆ’Ã†â€™ÃƒÂ¢Ã¢â€šÂ¬Ã‚Â¦ÃƒÆ’Ã¢â‚¬Å¡Ãƒâ€šÃ‚Â¡ÃƒÆ’Ã†â€™Ãƒâ€ Ã¢â‚¬â„¢ÃƒÆ’Ã‚Â¢ÃƒÂ¢Ã¢â‚¬Å¡Ã‚Â¬Ãƒâ€¦Ã‚Â¡ÃƒÆ’Ã†â€™ÃƒÂ¢Ã¢â€šÂ¬Ã…Â¡ÃƒÆ’Ã¢â‚¬Å¡Ãƒâ€šÃ‚Â¬ÃƒÆ’Ã†â€™Ãƒâ€ Ã¢â‚¬â„¢ÃƒÆ’Ã¢â‚¬Â ÃƒÂ¢Ã¢â€šÂ¬Ã¢â€žÂ¢ÃƒÆ’Ã†â€™Ãƒâ€šÃ‚Â¢ÃƒÆ’Ã‚Â¢ÃƒÂ¢Ã¢â€šÂ¬Ã…Â¡Ãƒâ€šÃ‚Â¬ÃƒÆ’Ã¢â‚¬Å¡Ãƒâ€šÃ‚Â¦ÃƒÆ’Ã†â€™Ãƒâ€ Ã¢â‚¬â„¢ÃƒÆ’Ã‚Â¢ÃƒÂ¢Ã¢â‚¬Å¡Ã‚Â¬Ãƒâ€¦Ã‚Â¡ÃƒÆ’Ã†â€™ÃƒÂ¢Ã¢â€šÂ¬Ã…Â¡ÃƒÆ’Ã¢â‚¬Å¡Ãƒâ€šÃ‚Â¡ÃƒÆ’Ã†â€™Ãƒâ€ Ã¢â‚¬â„¢ÃƒÆ’Ã¢â‚¬Â ÃƒÂ¢Ã¢â€šÂ¬Ã¢â€žÂ¢ÃƒÆ’Ã†â€™ÃƒÂ¢Ã¢â€šÂ¬Ã‚Â ÃƒÆ’Ã‚Â¢ÃƒÂ¢Ã¢â‚¬Å¡Ã‚Â¬ÃƒÂ¢Ã¢â‚¬Å¾Ã‚Â¢ÃƒÆ’Ã†â€™Ãƒâ€ Ã¢â‚¬â„¢ÃƒÆ’Ã¢â‚¬Å¡Ãƒâ€šÃ‚Â¢ÃƒÆ’Ã†â€™Ãƒâ€šÃ‚Â¢ÃƒÆ’Ã‚Â¢ÃƒÂ¢Ã¢â‚¬Å¡Ã‚Â¬Ãƒâ€¦Ã‚Â¡ÃƒÆ’Ã¢â‚¬Å¡Ãƒâ€šÃ‚Â¬ÃƒÆ’Ã†â€™ÃƒÂ¢Ã¢â€šÂ¬Ã‚Â¦ÃƒÆ’Ã¢â‚¬Å¡Ãƒâ€šÃ‚Â¡ÃƒÆ’Ã†â€™Ãƒâ€ Ã¢â‚¬â„¢ÃƒÆ’Ã¢â‚¬Â ÃƒÂ¢Ã¢â€šÂ¬Ã¢â€žÂ¢ÃƒÆ’Ã†â€™Ãƒâ€šÃ‚Â¢ÃƒÆ’Ã‚Â¢ÃƒÂ¢Ã¢â€šÂ¬Ã…Â¡Ãƒâ€šÃ‚Â¬ÃƒÆ’Ã¢â‚¬Â¦Ãƒâ€šÃ‚Â¡ÃƒÆ’Ã†â€™Ãƒâ€ Ã¢â‚¬â„¢ÃƒÆ’Ã‚Â¢ÃƒÂ¢Ã¢â‚¬Å¡Ã‚Â¬Ãƒâ€¦Ã‚Â¡ÃƒÆ’Ã†â€™ÃƒÂ¢Ã¢â€šÂ¬Ã…Â¡ÃƒÆ’Ã¢â‚¬Å¡Ãƒâ€šÃ‚Â¬ÃƒÆ’Ã†â€™Ãƒâ€ Ã¢â‚¬â„¢ÃƒÆ’Ã¢â‚¬Â ÃƒÂ¢Ã¢â€šÂ¬Ã¢â€žÂ¢ÃƒÆ’Ã†â€™ÃƒÂ¢Ã¢â€šÂ¬Ã‚Â ÃƒÆ’Ã‚Â¢ÃƒÂ¢Ã¢â‚¬Å¡Ã‚Â¬ÃƒÂ¢Ã¢â‚¬Å¾Ã‚Â¢ÃƒÆ’Ã†â€™Ãƒâ€ Ã¢â‚¬â„¢ÃƒÆ’Ã‚Â¢ÃƒÂ¢Ã¢â‚¬Å¡Ã‚Â¬Ãƒâ€šÃ‚Â ÃƒÆ’Ã†â€™Ãƒâ€šÃ‚Â¢ÃƒÆ’Ã‚Â¢ÃƒÂ¢Ã¢â€šÂ¬Ã…Â¡Ãƒâ€šÃ‚Â¬ÃƒÆ’Ã‚Â¢ÃƒÂ¢Ã¢â€šÂ¬Ã…Â¾Ãƒâ€šÃ‚Â¢ÃƒÆ’Ã†â€™Ãƒâ€ Ã¢â‚¬â„¢ÃƒÆ’Ã¢â‚¬Â ÃƒÂ¢Ã¢â€šÂ¬Ã¢â€žÂ¢ÃƒÆ’Ã†â€™ÃƒÂ¢Ã¢â€šÂ¬Ã…Â¡ÃƒÆ’Ã¢â‚¬Å¡Ãƒâ€šÃ‚Â¢ÃƒÆ’Ã†â€™Ãƒâ€ Ã¢â‚¬â„¢ÃƒÆ’Ã¢â‚¬Å¡Ãƒâ€šÃ‚Â¢ÃƒÆ’Ã†â€™Ãƒâ€šÃ‚Â¢ÃƒÆ’Ã‚Â¢ÃƒÂ¢Ã¢â€šÂ¬Ã…Â¡Ãƒâ€šÃ‚Â¬ÃƒÆ’Ã¢â‚¬Â¦Ãƒâ€šÃ‚Â¡ÃƒÆ’Ã†â€™ÃƒÂ¢Ã¢â€šÂ¬Ã…Â¡ÃƒÆ’Ã¢â‚¬Å¡Ãƒâ€šÃ‚Â¬ÃƒÆ’Ã†â€™Ãƒâ€ Ã¢â‚¬â„¢ÃƒÆ’Ã‚Â¢ÃƒÂ¢Ã¢â‚¬Å¡Ã‚Â¬Ãƒâ€¦Ã‚Â¡ÃƒÆ’Ã†â€™ÃƒÂ¢Ã¢â€šÂ¬Ã…Â¡ÃƒÆ’Ã¢â‚¬Å¡Ãƒâ€šÃ‚Â¦ÃƒÆ’Ã†â€™Ãƒâ€ Ã¢â‚¬â„¢ÃƒÆ’Ã¢â‚¬Â ÃƒÂ¢Ã¢â€šÂ¬Ã¢â€žÂ¢ÃƒÆ’Ã†â€™ÃƒÂ¢Ã¢â€šÂ¬Ã‚Â ÃƒÆ’Ã‚Â¢ÃƒÂ¢Ã¢â‚¬Å¡Ã‚Â¬ÃƒÂ¢Ã¢â‚¬Å¾Ã‚Â¢ÃƒÆ’Ã†â€™Ãƒâ€ Ã¢â‚¬â„¢ÃƒÆ’Ã‚Â¢ÃƒÂ¢Ã¢â‚¬Å¡Ã‚Â¬Ãƒâ€¦Ã‚Â¡ÃƒÆ’Ã†â€™ÃƒÂ¢Ã¢â€šÂ¬Ã…Â¡ÃƒÆ’Ã¢â‚¬Å¡Ãƒâ€šÃ‚Â¢ÃƒÆ’Ã†â€™Ãƒâ€ Ã¢â‚¬â„¢ÃƒÆ’Ã¢â‚¬Â ÃƒÂ¢Ã¢â€šÂ¬Ã¢â€žÂ¢ÃƒÆ’Ã†â€™ÃƒÂ¢Ã¢â€šÂ¬Ã…Â¡ÃƒÆ’Ã¢â‚¬Å¡Ãƒâ€šÃ‚Â¢ÃƒÆ’Ã†â€™Ãƒâ€ Ã¢â‚¬â„¢ÃƒÆ’Ã¢â‚¬Å¡Ãƒâ€šÃ‚Â¢ÃƒÆ’Ã†â€™Ãƒâ€šÃ‚Â¢ÃƒÆ’Ã‚Â¢ÃƒÂ¢Ã¢â‚¬Å¡Ã‚Â¬Ãƒâ€¦Ã‚Â¡ÃƒÆ’Ã¢â‚¬Å¡Ãƒâ€šÃ‚Â¬ÃƒÆ’Ã†â€™ÃƒÂ¢Ã¢â€šÂ¬Ã‚Â¦ÃƒÆ’Ã¢â‚¬Å¡Ãƒâ€šÃ‚Â¡ÃƒÆ’Ã†â€™Ãƒâ€ Ã¢â‚¬â„¢ÃƒÆ’Ã‚Â¢ÃƒÂ¢Ã¢â‚¬Å¡Ã‚Â¬Ãƒâ€¦Ã‚Â¡ÃƒÆ’Ã†â€™ÃƒÂ¢Ã¢â€šÂ¬Ã…Â¡ÃƒÆ’Ã¢â‚¬Å¡Ãƒâ€šÃ‚Â¬ÃƒÆ’Ã†â€™Ãƒâ€ Ã¢â‚¬â„¢ÃƒÆ’Ã¢â‚¬Â ÃƒÂ¢Ã¢â€šÂ¬Ã¢â€žÂ¢ÃƒÆ’Ã†â€™Ãƒâ€šÃ‚Â¢ÃƒÆ’Ã‚Â¢ÃƒÂ¢Ã¢â€šÂ¬Ã…Â¡Ãƒâ€šÃ‚Â¬ÃƒÆ’Ã¢â‚¬Å¡Ãƒâ€šÃ‚Â¦ÃƒÆ’Ã†â€™Ãƒâ€ Ã¢â‚¬â„¢ÃƒÆ’Ã¢â‚¬Å¡Ãƒâ€šÃ‚Â¢ÃƒÆ’Ã†â€™Ãƒâ€šÃ‚Â¢ÃƒÆ’Ã‚Â¢ÃƒÂ¢Ã¢â‚¬Å¡Ã‚Â¬Ãƒâ€¦Ã‚Â¡ÃƒÆ’Ã¢â‚¬Å¡Ãƒâ€šÃ‚Â¬ÃƒÆ’Ã†â€™ÃƒÂ¢Ã¢â€šÂ¬Ã‚Â¦ÃƒÆ’Ã‚Â¢ÃƒÂ¢Ã¢â‚¬Å¡Ã‚Â¬Ãƒâ€¦Ã¢â‚¬Å“25.9ÃƒÆ’Ã†â€™Ãƒâ€ Ã¢â‚¬â„¢ÃƒÆ’Ã¢â‚¬Â ÃƒÂ¢Ã¢â€šÂ¬Ã¢â€žÂ¢ÃƒÆ’Ã†â€™ÃƒÂ¢Ã¢â€šÂ¬Ã‚Â ÃƒÆ’Ã‚Â¢ÃƒÂ¢Ã¢â‚¬Å¡Ã‚Â¬ÃƒÂ¢Ã¢â‚¬Å¾Ã‚Â¢ÃƒÆ’Ã†â€™Ãƒâ€ Ã¢â‚¬â„¢ÃƒÆ’Ã‚Â¢ÃƒÂ¢Ã¢â‚¬Å¡Ã‚Â¬Ãƒâ€šÃ‚Â ÃƒÆ’Ã†â€™Ãƒâ€šÃ‚Â¢ÃƒÆ’Ã‚Â¢ÃƒÂ¢Ã¢â€šÂ¬Ã…Â¡Ãƒâ€šÃ‚Â¬ÃƒÆ’Ã‚Â¢ÃƒÂ¢Ã¢â€šÂ¬Ã…Â¾Ãƒâ€šÃ‚Â¢ÃƒÆ’Ã†â€™Ãƒâ€ Ã¢â‚¬â„¢ÃƒÆ’Ã¢â‚¬Â ÃƒÂ¢Ã¢â€šÂ¬Ã¢â€žÂ¢ÃƒÆ’Ã†â€™Ãƒâ€šÃ‚Â¢ÃƒÆ’Ã‚Â¢ÃƒÂ¢Ã¢â€šÂ¬Ã…Â¡Ãƒâ€šÃ‚Â¬ÃƒÆ’Ã¢â‚¬Å¡Ãƒâ€šÃ‚Â ÃƒÆ’Ã†â€™Ãƒâ€ Ã¢â‚¬â„¢ÃƒÆ’Ã¢â‚¬Å¡Ãƒâ€šÃ‚Â¢ÃƒÆ’Ã†â€™Ãƒâ€šÃ‚Â¢ÃƒÆ’Ã‚Â¢ÃƒÂ¢Ã¢â‚¬Å¡Ã‚Â¬Ãƒâ€¦Ã‚Â¡ÃƒÆ’Ã¢â‚¬Å¡Ãƒâ€šÃ‚Â¬ÃƒÆ’Ã†â€™Ãƒâ€šÃ‚Â¢ÃƒÆ’Ã‚Â¢ÃƒÂ¢Ã¢â‚¬Å¡Ã‚Â¬Ãƒâ€¦Ã‚Â¾ÃƒÆ’Ã¢â‚¬Å¡Ãƒâ€šÃ‚Â¢ÃƒÆ’Ã†â€™Ãƒâ€ Ã¢â‚¬â„¢ÃƒÆ’Ã¢â‚¬Â ÃƒÂ¢Ã¢â€šÂ¬Ã¢â€žÂ¢ÃƒÆ’Ã†â€™ÃƒÂ¢Ã¢â€šÂ¬Ã‚Â ÃƒÆ’Ã‚Â¢ÃƒÂ¢Ã¢â‚¬Å¡Ã‚Â¬ÃƒÂ¢Ã¢â‚¬Å¾Ã‚Â¢ÃƒÆ’Ã†â€™Ãƒâ€ Ã¢â‚¬â„¢ÃƒÆ’Ã¢â‚¬Å¡Ãƒâ€šÃ‚Â¢ÃƒÆ’Ã†â€™Ãƒâ€šÃ‚Â¢ÃƒÆ’Ã‚Â¢ÃƒÂ¢Ã¢â‚¬Å¡Ã‚Â¬Ãƒâ€¦Ã‚Â¡ÃƒÆ’Ã¢â‚¬Å¡Ãƒâ€šÃ‚Â¬ÃƒÆ’Ã†â€™ÃƒÂ¢Ã¢â€šÂ¬Ã…Â¡ÃƒÆ’Ã¢â‚¬Å¡Ãƒâ€šÃ‚Â ÃƒÆ’Ã†â€™Ãƒâ€ Ã¢â‚¬â„¢ÃƒÆ’Ã¢â‚¬Â ÃƒÂ¢Ã¢â€šÂ¬Ã¢â€žÂ¢ÃƒÆ’Ã†â€™ÃƒÂ¢Ã¢â€šÂ¬Ã…Â¡ÃƒÆ’Ã¢â‚¬Å¡Ãƒâ€šÃ‚Â¢ÃƒÆ’Ã†â€™Ãƒâ€ Ã¢â‚¬â„¢ÃƒÆ’Ã¢â‚¬Å¡Ãƒâ€šÃ‚Â¢ÃƒÆ’Ã†â€™Ãƒâ€šÃ‚Â¢ÃƒÆ’Ã‚Â¢ÃƒÂ¢Ã¢â€šÂ¬Ã…Â¡Ãƒâ€šÃ‚Â¬ÃƒÆ’Ã¢â‚¬Â¦Ãƒâ€šÃ‚Â¡ÃƒÆ’Ã†â€™ÃƒÂ¢Ã¢â€šÂ¬Ã…Â¡ÃƒÆ’Ã¢â‚¬Å¡Ãƒâ€šÃ‚Â¬ÃƒÆ’Ã†â€™Ãƒâ€ Ã¢â‚¬â„¢ÃƒÆ’Ã¢â‚¬Å¡Ãƒâ€šÃ‚Â¢ÃƒÆ’Ã†â€™Ãƒâ€šÃ‚Â¢ÃƒÆ’Ã‚Â¢ÃƒÂ¢Ã¢â€šÂ¬Ã…Â¡Ãƒâ€šÃ‚Â¬ÃƒÆ’Ã¢â‚¬Â¦Ãƒâ€šÃ‚Â¾ÃƒÆ’Ã†â€™ÃƒÂ¢Ã¢â€šÂ¬Ã…Â¡ÃƒÆ’Ã¢â‚¬Å¡Ãƒâ€šÃ‚Â¢ÃƒÆ’Ã†â€™Ãƒâ€ Ã¢â‚¬â„¢ÃƒÆ’Ã¢â‚¬Â ÃƒÂ¢Ã¢â€šÂ¬Ã¢â€žÂ¢ÃƒÆ’Ã†â€™ÃƒÂ¢Ã¢â€šÂ¬Ã‚Â ÃƒÆ’Ã‚Â¢ÃƒÂ¢Ã¢â‚¬Å¡Ã‚Â¬ÃƒÂ¢Ã¢â‚¬Å¾Ã‚Â¢ÃƒÆ’Ã†â€™Ãƒâ€ Ã¢â‚¬â„¢ÃƒÆ’Ã‚Â¢ÃƒÂ¢Ã¢â‚¬Å¡Ã‚Â¬Ãƒâ€šÃ‚Â ÃƒÆ’Ã†â€™Ãƒâ€šÃ‚Â¢ÃƒÆ’Ã‚Â¢ÃƒÂ¢Ã¢â€šÂ¬Ã…Â¡Ãƒâ€šÃ‚Â¬ÃƒÆ’Ã‚Â¢ÃƒÂ¢Ã¢â€šÂ¬Ã…Â¾Ãƒâ€šÃ‚Â¢ÃƒÆ’Ã†â€™Ãƒâ€ Ã¢â‚¬â„¢ÃƒÆ’Ã¢â‚¬Â ÃƒÂ¢Ã¢â€šÂ¬Ã¢â€žÂ¢ÃƒÆ’Ã†â€™Ãƒâ€šÃ‚Â¢ÃƒÆ’Ã‚Â¢ÃƒÂ¢Ã¢â€šÂ¬Ã…Â¡Ãƒâ€šÃ‚Â¬ÃƒÆ’Ã¢â‚¬Â¦Ãƒâ€šÃ‚Â¡ÃƒÆ’Ã†â€™Ãƒâ€ Ã¢â‚¬â„¢ÃƒÆ’Ã‚Â¢ÃƒÂ¢Ã¢â‚¬Å¡Ã‚Â¬Ãƒâ€¦Ã‚Â¡ÃƒÆ’Ã†â€™ÃƒÂ¢Ã¢â€šÂ¬Ã…Â¡ÃƒÆ’Ã¢â‚¬Å¡Ãƒâ€šÃ‚Â¢ÃƒÆ’Ã†â€™Ãƒâ€ Ã¢â‚¬â„¢ÃƒÆ’Ã¢â‚¬Â ÃƒÂ¢Ã¢â€šÂ¬Ã¢â€žÂ¢ÃƒÆ’Ã†â€™ÃƒÂ¢Ã¢â€šÂ¬Ã‚Â ÃƒÆ’Ã‚Â¢ÃƒÂ¢Ã¢â‚¬Å¡Ã‚Â¬ÃƒÂ¢Ã¢â‚¬Å¾Ã‚Â¢ÃƒÆ’Ã†â€™Ãƒâ€ Ã¢â‚¬â„¢ÃƒÆ’Ã‚Â¢ÃƒÂ¢Ã¢â‚¬Å¡Ã‚Â¬Ãƒâ€¦Ã‚Â¡ÃƒÆ’Ã†â€™ÃƒÂ¢Ã¢â€šÂ¬Ã…Â¡ÃƒÆ’Ã¢â‚¬Å¡Ãƒâ€šÃ‚Â¢ÃƒÆ’Ã†â€™Ãƒâ€ Ã¢â‚¬â„¢ÃƒÆ’Ã¢â‚¬Â ÃƒÂ¢Ã¢â€šÂ¬Ã¢â€žÂ¢ÃƒÆ’Ã†â€™ÃƒÂ¢Ã¢â€šÂ¬Ã…Â¡ÃƒÆ’Ã¢â‚¬Å¡Ãƒâ€šÃ‚Â¢ÃƒÆ’Ã†â€™Ãƒâ€ Ã¢â‚¬â„¢ÃƒÆ’Ã¢â‚¬Å¡Ãƒâ€šÃ‚Â¢ÃƒÆ’Ã†â€™Ãƒâ€šÃ‚Â¢ÃƒÆ’Ã‚Â¢ÃƒÂ¢Ã¢â€šÂ¬Ã…Â¡Ãƒâ€šÃ‚Â¬ÃƒÆ’Ã¢â‚¬Â¦Ãƒâ€šÃ‚Â¡ÃƒÆ’Ã†â€™ÃƒÂ¢Ã¢â€šÂ¬Ã…Â¡ÃƒÆ’Ã¢â‚¬Å¡Ãƒâ€šÃ‚Â¬ÃƒÆ’Ã†â€™Ãƒâ€ Ã¢â‚¬â„¢ÃƒÆ’Ã‚Â¢ÃƒÂ¢Ã¢â‚¬Å¡Ã‚Â¬Ãƒâ€šÃ‚Â¦ÃƒÆ’Ã†â€™ÃƒÂ¢Ã¢â€šÂ¬Ã…Â¡ÃƒÆ’Ã¢â‚¬Å¡Ãƒâ€šÃ‚Â¡ÃƒÆ’Ã†â€™Ãƒâ€ Ã¢â‚¬â„¢ÃƒÆ’Ã¢â‚¬Â ÃƒÂ¢Ã¢â€šÂ¬Ã¢â€žÂ¢ÃƒÆ’Ã†â€™Ãƒâ€šÃ‚Â¢ÃƒÆ’Ã‚Â¢ÃƒÂ¢Ã¢â€šÂ¬Ã…Â¡Ãƒâ€šÃ‚Â¬ÃƒÆ’Ã¢â‚¬Â¦Ãƒâ€šÃ‚Â¡ÃƒÆ’Ã†â€™Ãƒâ€ Ã¢â‚¬â„¢ÃƒÆ’Ã‚Â¢ÃƒÂ¢Ã¢â‚¬Å¡Ã‚Â¬Ãƒâ€¦Ã‚Â¡ÃƒÆ’Ã†â€™ÃƒÂ¢Ã¢â€šÂ¬Ã…Â¡ÃƒÆ’Ã¢â‚¬Å¡Ãƒâ€šÃ‚Â¬ÃƒÆ’Ã†â€™Ãƒâ€ Ã¢â‚¬â„¢ÃƒÆ’Ã¢â‚¬Â ÃƒÂ¢Ã¢â€šÂ¬Ã¢â€žÂ¢ÃƒÆ’Ã†â€™ÃƒÂ¢Ã¢â€šÂ¬Ã‚Â ÃƒÆ’Ã‚Â¢ÃƒÂ¢Ã¢â‚¬Å¡Ã‚Â¬ÃƒÂ¢Ã¢â‚¬Å¾Ã‚Â¢ÃƒÆ’Ã†â€™Ãƒâ€ Ã¢â‚¬â„¢ÃƒÆ’Ã¢â‚¬Å¡Ãƒâ€šÃ‚Â¢ÃƒÆ’Ã†â€™Ãƒâ€šÃ‚Â¢ÃƒÆ’Ã‚Â¢ÃƒÂ¢Ã¢â‚¬Å¡Ã‚Â¬Ãƒâ€¦Ã‚Â¡ÃƒÆ’Ã¢â‚¬Å¡Ãƒâ€šÃ‚Â¬ÃƒÆ’Ã†â€™ÃƒÂ¢Ã¢â€šÂ¬Ã…Â¡ÃƒÆ’Ã¢â‚¬Å¡Ãƒâ€šÃ‚Â¦ÃƒÆ’Ã†â€™Ãƒâ€ Ã¢â‚¬â„¢ÃƒÆ’Ã¢â‚¬Â ÃƒÂ¢Ã¢â€šÂ¬Ã¢â€žÂ¢ÃƒÆ’Ã†â€™Ãƒâ€šÃ‚Â¢ÃƒÆ’Ã‚Â¢ÃƒÂ¢Ã¢â€šÂ¬Ã…Â¡Ãƒâ€šÃ‚Â¬ÃƒÆ’Ã¢â‚¬Â¦Ãƒâ€šÃ‚Â¡ÃƒÆ’Ã†â€™Ãƒâ€ Ã¢â‚¬â„¢ÃƒÆ’Ã‚Â¢ÃƒÂ¢Ã¢â‚¬Å¡Ã‚Â¬Ãƒâ€¦Ã‚Â¡ÃƒÆ’Ã†â€™ÃƒÂ¢Ã¢â€šÂ¬Ã…Â¡ÃƒÆ’Ã¢â‚¬Å¡Ãƒâ€šÃ‚Â¡ÃƒÆ’Ã†â€™Ãƒâ€ Ã¢â‚¬â„¢ÃƒÆ’Ã¢â‚¬Â ÃƒÂ¢Ã¢â€šÂ¬Ã¢â€žÂ¢ÃƒÆ’Ã†â€™ÃƒÂ¢Ã¢â€šÂ¬Ã‚Â ÃƒÆ’Ã‚Â¢ÃƒÂ¢Ã¢â‚¬Å¡Ã‚Â¬ÃƒÂ¢Ã¢â‚¬Å¾Ã‚Â¢ÃƒÆ’Ã†â€™Ãƒâ€ Ã¢â‚¬â„¢ÃƒÆ’Ã‚Â¢ÃƒÂ¢Ã¢â‚¬Å¡Ã‚Â¬Ãƒâ€šÃ‚Â ÃƒÆ’Ã†â€™Ãƒâ€šÃ‚Â¢ÃƒÆ’Ã‚Â¢ÃƒÂ¢Ã¢â€šÂ¬Ã…Â¡Ãƒâ€šÃ‚Â¬ÃƒÆ’Ã‚Â¢ÃƒÂ¢Ã¢â€šÂ¬Ã…Â¾Ãƒâ€šÃ‚Â¢ÃƒÆ’Ã†â€™Ãƒâ€ Ã¢â‚¬â„¢ÃƒÆ’Ã¢â‚¬Â ÃƒÂ¢Ã¢â€šÂ¬Ã¢â€žÂ¢ÃƒÆ’Ã†â€™Ãƒâ€šÃ‚Â¢ÃƒÆ’Ã‚Â¢ÃƒÂ¢Ã¢â€šÂ¬Ã…Â¡Ãƒâ€šÃ‚Â¬ÃƒÆ’Ã¢â‚¬Å¡Ãƒâ€šÃ‚Â ÃƒÆ’Ã†â€™Ãƒâ€ Ã¢â‚¬â„¢ÃƒÆ’Ã¢â‚¬Å¡Ãƒâ€šÃ‚Â¢ÃƒÆ’Ã†â€™Ãƒâ€šÃ‚Â¢ÃƒÆ’Ã‚Â¢ÃƒÂ¢Ã¢â‚¬Å¡Ã‚Â¬Ãƒâ€¦Ã‚Â¡ÃƒÆ’Ã¢â‚¬Å¡Ãƒâ€šÃ‚Â¬ÃƒÆ’Ã†â€™Ãƒâ€šÃ‚Â¢ÃƒÆ’Ã‚Â¢ÃƒÂ¢Ã¢â‚¬Å¡Ã‚Â¬Ãƒâ€¦Ã‚Â¾ÃƒÆ’Ã¢â‚¬Å¡Ãƒâ€šÃ‚Â¢ÃƒÆ’Ã†â€™Ãƒâ€ Ã¢â‚¬â„¢ÃƒÆ’Ã¢â‚¬Â ÃƒÂ¢Ã¢â€šÂ¬Ã¢â€žÂ¢ÃƒÆ’Ã†â€™ÃƒÂ¢Ã¢â€šÂ¬Ã‚Â ÃƒÆ’Ã‚Â¢ÃƒÂ¢Ã¢â‚¬Å¡Ã‚Â¬ÃƒÂ¢Ã¢â‚¬Å¾Ã‚Â¢ÃƒÆ’Ã†â€™Ãƒâ€ Ã¢â‚¬â„¢ÃƒÆ’Ã‚Â¢ÃƒÂ¢Ã¢â‚¬Å¡Ã‚Â¬Ãƒâ€¦Ã‚Â¡ÃƒÆ’Ã†â€™ÃƒÂ¢Ã¢â€šÂ¬Ã…Â¡ÃƒÆ’Ã¢â‚¬Å¡Ãƒâ€šÃ‚Â¢ÃƒÆ’Ã†â€™Ãƒâ€ Ã¢â‚¬â„¢ÃƒÆ’Ã¢â‚¬Â ÃƒÂ¢Ã¢â€šÂ¬Ã¢â€žÂ¢ÃƒÆ’Ã†â€™ÃƒÂ¢Ã¢â€šÂ¬Ã…Â¡ÃƒÆ’Ã¢â‚¬Å¡Ãƒâ€šÃ‚Â¢ÃƒÆ’Ã†â€™Ãƒâ€ Ã¢â‚¬â„¢ÃƒÆ’Ã¢â‚¬Å¡Ãƒâ€šÃ‚Â¢ÃƒÆ’Ã†â€™Ãƒâ€šÃ‚Â¢ÃƒÆ’Ã‚Â¢ÃƒÂ¢Ã¢â‚¬Å¡Ã‚Â¬Ãƒâ€¦Ã‚Â¡ÃƒÆ’Ã¢â‚¬Å¡Ãƒâ€šÃ‚Â¬ÃƒÆ’Ã†â€™ÃƒÂ¢Ã¢â€šÂ¬Ã‚Â¦ÃƒÆ’Ã¢â‚¬Å¡Ãƒâ€šÃ‚Â¡ÃƒÆ’Ã†â€™Ãƒâ€ Ã¢â‚¬â„¢ÃƒÆ’Ã‚Â¢ÃƒÂ¢Ã¢â‚¬Å¡Ã‚Â¬Ãƒâ€¦Ã‚Â¡ÃƒÆ’Ã†â€™ÃƒÂ¢Ã¢â€šÂ¬Ã…Â¡ÃƒÆ’Ã¢â‚¬Å¡Ãƒâ€šÃ‚Â¬ÃƒÆ’Ã†â€™Ãƒâ€ Ã¢â‚¬â„¢ÃƒÆ’Ã¢â‚¬Â ÃƒÂ¢Ã¢â€šÂ¬Ã¢â€žÂ¢ÃƒÆ’Ã†â€™Ãƒâ€šÃ‚Â¢ÃƒÆ’Ã‚Â¢ÃƒÂ¢Ã¢â€šÂ¬Ã…Â¡Ãƒâ€šÃ‚Â¬ÃƒÆ’Ã¢â‚¬Å¡Ãƒâ€šÃ‚Â¦ÃƒÆ’Ã†â€™Ãƒâ€ Ã¢â‚¬â„¢ÃƒÆ’Ã‚Â¢ÃƒÂ¢Ã¢â‚¬Å¡Ã‚Â¬Ãƒâ€¦Ã‚Â¡ÃƒÆ’Ã†â€™ÃƒÂ¢Ã¢â€šÂ¬Ã…Â¡ÃƒÆ’Ã¢â‚¬Å¡Ãƒâ€šÃ‚Â¡ÃƒÆ’Ã†â€™Ãƒâ€ Ã¢â‚¬â„¢ÃƒÆ’Ã¢â‚¬Â ÃƒÂ¢Ã¢â€šÂ¬Ã¢â€žÂ¢ÃƒÆ’Ã†â€™ÃƒÂ¢Ã¢â€šÂ¬Ã‚Â ÃƒÆ’Ã‚Â¢ÃƒÂ¢Ã¢â‚¬Å¡Ã‚Â¬ÃƒÂ¢Ã¢â‚¬Å¾Ã‚Â¢ÃƒÆ’Ã†â€™Ãƒâ€ Ã¢â‚¬â„¢ÃƒÆ’Ã‚Â¢ÃƒÂ¢Ã¢â‚¬Å¡Ã‚Â¬Ãƒâ€šÃ‚Â ÃƒÆ’Ã†â€™Ãƒâ€šÃ‚Â¢ÃƒÆ’Ã‚Â¢ÃƒÂ¢Ã¢â€šÂ¬Ã…Â¡Ãƒâ€šÃ‚Â¬ÃƒÆ’Ã‚Â¢ÃƒÂ¢Ã¢â€šÂ¬Ã…Â¾Ãƒâ€šÃ‚Â¢ÃƒÆ’Ã†â€™Ãƒâ€ Ã¢â‚¬â„¢ÃƒÆ’Ã¢â‚¬Â ÃƒÂ¢Ã¢â€šÂ¬Ã¢â€žÂ¢ÃƒÆ’Ã†â€™ÃƒÂ¢Ã¢â€šÂ¬Ã…Â¡ÃƒÆ’Ã¢â‚¬Å¡Ãƒâ€šÃ‚Â¢ÃƒÆ’Ã†â€™Ãƒâ€ Ã¢â‚¬â„¢ÃƒÆ’Ã¢â‚¬Å¡Ãƒâ€šÃ‚Â¢ÃƒÆ’Ã†â€™Ãƒâ€šÃ‚Â¢ÃƒÆ’Ã‚Â¢ÃƒÂ¢Ã¢â€šÂ¬Ã…Â¡Ãƒâ€šÃ‚Â¬ÃƒÆ’Ã¢â‚¬Â¦Ãƒâ€šÃ‚Â¡ÃƒÆ’Ã†â€™ÃƒÂ¢Ã¢â€šÂ¬Ã…Â¡ÃƒÆ’Ã¢â‚¬Å¡Ãƒâ€šÃ‚Â¬ÃƒÆ’Ã†â€™Ãƒâ€ Ã¢â‚¬â„¢ÃƒÆ’Ã‚Â¢ÃƒÂ¢Ã¢â‚¬Å¡Ã‚Â¬Ãƒâ€šÃ‚Â¦ÃƒÆ’Ã†â€™ÃƒÂ¢Ã¢â€šÂ¬Ã…Â¡ÃƒÆ’Ã¢â‚¬Å¡Ãƒâ€šÃ‚Â¡ÃƒÆ’Ã†â€™Ãƒâ€ Ã¢â‚¬â„¢ÃƒÆ’Ã¢â‚¬Â ÃƒÂ¢Ã¢â€šÂ¬Ã¢â€žÂ¢ÃƒÆ’Ã†â€™ÃƒÂ¢Ã¢â€šÂ¬Ã‚Â ÃƒÆ’Ã‚Â¢ÃƒÂ¢Ã¢â‚¬Å¡Ã‚Â¬ÃƒÂ¢Ã¢â‚¬Å¾Ã‚Â¢ÃƒÆ’Ã†â€™Ãƒâ€ Ã¢â‚¬â„¢ÃƒÆ’Ã¢â‚¬Å¡Ãƒâ€šÃ‚Â¢ÃƒÆ’Ã†â€™Ãƒâ€šÃ‚Â¢ÃƒÆ’Ã‚Â¢ÃƒÂ¢Ã¢â‚¬Å¡Ã‚Â¬Ãƒâ€¦Ã‚Â¡ÃƒÆ’Ã¢â‚¬Å¡Ãƒâ€šÃ‚Â¬ÃƒÆ’Ã†â€™ÃƒÂ¢Ã¢â€šÂ¬Ã‚Â¦ÃƒÆ’Ã¢â‚¬Å¡Ãƒâ€šÃ‚Â¡ÃƒÆ’Ã†â€™Ãƒâ€ Ã¢â‚¬â„¢ÃƒÆ’Ã¢â‚¬Â ÃƒÂ¢Ã¢â€šÂ¬Ã¢â€žÂ¢ÃƒÆ’Ã†â€™Ãƒâ€šÃ‚Â¢ÃƒÆ’Ã‚Â¢ÃƒÂ¢Ã¢â€šÂ¬Ã…Â¡Ãƒâ€šÃ‚Â¬ÃƒÆ’Ã¢â‚¬Â¦Ãƒâ€šÃ‚Â¡ÃƒÆ’Ã†â€™Ãƒâ€ Ã¢â‚¬â„¢ÃƒÆ’Ã‚Â¢ÃƒÂ¢Ã¢â‚¬Å¡Ã‚Â¬Ãƒâ€¦Ã‚Â¡ÃƒÆ’Ã†â€™ÃƒÂ¢Ã¢â€šÂ¬Ã…Â¡ÃƒÆ’Ã¢â‚¬Å¡Ãƒâ€šÃ‚Â°C in Week 4, before recovering and stabilizing at about 28.1ÃƒÆ’Ã†â€™Ãƒâ€ Ã¢â‚¬â„¢ÃƒÆ’Ã¢â‚¬Â ÃƒÂ¢Ã¢â€šÂ¬Ã¢â€žÂ¢ÃƒÆ’Ã†â€™ÃƒÂ¢Ã¢â€šÂ¬Ã‚Â ÃƒÆ’Ã‚Â¢ÃƒÂ¢Ã¢â‚¬Å¡Ã‚Â¬ÃƒÂ¢Ã¢â‚¬Å¾Ã‚Â¢ÃƒÆ’Ã†â€™Ãƒâ€ Ã¢â‚¬â„¢ÃƒÆ’Ã‚Â¢ÃƒÂ¢Ã¢â‚¬Å¡Ã‚Â¬Ãƒâ€šÃ‚Â ÃƒÆ’Ã†â€™Ãƒâ€šÃ‚Â¢ÃƒÆ’Ã‚Â¢ÃƒÂ¢Ã¢â€šÂ¬Ã…Â¡Ãƒâ€šÃ‚Â¬ÃƒÆ’Ã‚Â¢ÃƒÂ¢Ã¢â€šÂ¬Ã…Â¾Ãƒâ€šÃ‚Â¢ÃƒÆ’Ã†â€™Ãƒâ€ Ã¢â‚¬â„¢ÃƒÆ’Ã¢â‚¬Â ÃƒÂ¢Ã¢â€šÂ¬Ã¢â€žÂ¢ÃƒÆ’Ã†â€™Ãƒâ€šÃ‚Â¢ÃƒÆ’Ã‚Â¢ÃƒÂ¢Ã¢â€šÂ¬Ã…Â¡Ãƒâ€šÃ‚Â¬ÃƒÆ’Ã¢â‚¬Å¡Ãƒâ€šÃ‚Â ÃƒÆ’Ã†â€™Ãƒâ€ Ã¢â‚¬â„¢ÃƒÆ’Ã¢â‚¬Å¡Ãƒâ€šÃ‚Â¢ÃƒÆ’Ã†â€™Ãƒâ€šÃ‚Â¢ÃƒÆ’Ã‚Â¢ÃƒÂ¢Ã¢â‚¬Å¡Ã‚Â¬Ãƒâ€¦Ã‚Â¡ÃƒÆ’Ã¢â‚¬Å¡Ãƒâ€šÃ‚Â¬ÃƒÆ’Ã†â€™Ãƒâ€šÃ‚Â¢ÃƒÆ’Ã‚Â¢ÃƒÂ¢Ã¢â‚¬Å¡Ã‚Â¬Ãƒâ€¦Ã‚Â¾ÃƒÆ’Ã¢â‚¬Å¡Ãƒâ€šÃ‚Â¢ÃƒÆ’Ã†â€™Ãƒâ€ Ã¢â‚¬â„¢ÃƒÆ’Ã¢â‚¬Â ÃƒÂ¢Ã¢â€šÂ¬Ã¢â€žÂ¢ÃƒÆ’Ã†â€™ÃƒÂ¢Ã¢â€šÂ¬Ã‚Â ÃƒÆ’Ã‚Â¢ÃƒÂ¢Ã¢â‚¬Å¡Ã‚Â¬ÃƒÂ¢Ã¢â‚¬Å¾Ã‚Â¢ÃƒÆ’Ã†â€™Ãƒâ€ Ã¢â‚¬â„¢ÃƒÆ’Ã¢â‚¬Å¡Ãƒâ€šÃ‚Â¢ÃƒÆ’Ã†â€™Ãƒâ€šÃ‚Â¢ÃƒÆ’Ã‚Â¢ÃƒÂ¢Ã¢â‚¬Å¡Ã‚Â¬Ãƒâ€¦Ã‚Â¡ÃƒÆ’Ã¢â‚¬Å¡Ãƒâ€šÃ‚Â¬ÃƒÆ’Ã†â€™ÃƒÂ¢Ã¢â€šÂ¬Ã…Â¡ÃƒÆ’Ã¢â‚¬Å¡Ãƒâ€šÃ‚Â ÃƒÆ’Ã†â€™Ãƒâ€ Ã¢â‚¬â„¢ÃƒÆ’Ã¢â‚¬Â ÃƒÂ¢Ã¢â€šÂ¬Ã¢â€žÂ¢ÃƒÆ’Ã†â€™ÃƒÂ¢Ã¢â€šÂ¬Ã…Â¡ÃƒÆ’Ã¢â‚¬Å¡Ãƒâ€šÃ‚Â¢ÃƒÆ’Ã†â€™Ãƒâ€ Ã¢â‚¬â„¢ÃƒÆ’Ã¢â‚¬Å¡Ãƒâ€šÃ‚Â¢ÃƒÆ’Ã†â€™Ãƒâ€šÃ‚Â¢ÃƒÆ’Ã‚Â¢ÃƒÂ¢Ã¢â€šÂ¬Ã…Â¡Ãƒâ€šÃ‚Â¬ÃƒÆ’Ã¢â‚¬Â¦Ãƒâ€šÃ‚Â¡ÃƒÆ’Ã†â€™ÃƒÂ¢Ã¢â€šÂ¬Ã…Â¡ÃƒÆ’Ã¢â‚¬Å¡Ãƒâ€šÃ‚Â¬ÃƒÆ’Ã†â€™Ãƒâ€ Ã¢â‚¬â„¢ÃƒÆ’Ã¢â‚¬Å¡Ãƒâ€šÃ‚Â¢ÃƒÆ’Ã†â€™Ãƒâ€šÃ‚Â¢ÃƒÆ’Ã‚Â¢ÃƒÂ¢Ã¢â€šÂ¬Ã…Â¡Ãƒâ€šÃ‚Â¬ÃƒÆ’Ã¢â‚¬Â¦Ãƒâ€šÃ‚Â¾ÃƒÆ’Ã†â€™ÃƒÂ¢Ã¢â€šÂ¬Ã…Â¡ÃƒÆ’Ã¢â‚¬Å¡Ãƒâ€šÃ‚Â¢ÃƒÆ’Ã†â€™Ãƒâ€ Ã¢â‚¬â„¢ÃƒÆ’Ã¢â‚¬Â ÃƒÂ¢Ã¢â€šÂ¬Ã¢â€žÂ¢ÃƒÆ’Ã†â€™ÃƒÂ¢Ã¢â€šÂ¬Ã‚Â ÃƒÆ’Ã‚Â¢ÃƒÂ¢Ã¢â‚¬Å¡Ã‚Â¬ÃƒÂ¢Ã¢â‚¬Å¾Ã‚Â¢ÃƒÆ’Ã†â€™Ãƒâ€ Ã¢â‚¬â„¢ÃƒÆ’Ã‚Â¢ÃƒÂ¢Ã¢â‚¬Å¡Ã‚Â¬Ãƒâ€šÃ‚Â ÃƒÆ’Ã†â€™Ãƒâ€šÃ‚Â¢ÃƒÆ’Ã‚Â¢ÃƒÂ¢Ã¢â€šÂ¬Ã…Â¡Ãƒâ€šÃ‚Â¬ÃƒÆ’Ã‚Â¢ÃƒÂ¢Ã¢â€šÂ¬Ã…Â¾Ãƒâ€šÃ‚Â¢ÃƒÆ’Ã†â€™Ãƒâ€ Ã¢â‚¬â„¢ÃƒÆ’Ã¢â‚¬Â ÃƒÂ¢Ã¢â€šÂ¬Ã¢â€žÂ¢ÃƒÆ’Ã†â€™Ãƒâ€šÃ‚Â¢ÃƒÆ’Ã‚Â¢ÃƒÂ¢Ã¢â€šÂ¬Ã…Â¡Ãƒâ€šÃ‚Â¬ÃƒÆ’Ã¢â‚¬Â¦Ãƒâ€šÃ‚Â¡ÃƒÆ’Ã†â€™Ãƒâ€ Ã¢â‚¬â„¢ÃƒÆ’Ã‚Â¢ÃƒÂ¢Ã¢â‚¬Å¡Ã‚Â¬Ãƒâ€¦Ã‚Â¡ÃƒÆ’Ã†â€™ÃƒÂ¢Ã¢â€šÂ¬Ã…Â¡ÃƒÆ’Ã¢â‚¬Å¡Ãƒâ€šÃ‚Â¢ÃƒÆ’Ã†â€™Ãƒâ€ Ã¢â‚¬â„¢ÃƒÆ’Ã¢â‚¬Â ÃƒÂ¢Ã¢â€šÂ¬Ã¢â€žÂ¢ÃƒÆ’Ã†â€™ÃƒÂ¢Ã¢â€šÂ¬Ã‚Â ÃƒÆ’Ã‚Â¢ÃƒÂ¢Ã¢â‚¬Å¡Ã‚Â¬ÃƒÂ¢Ã¢â‚¬Å¾Ã‚Â¢ÃƒÆ’Ã†â€™Ãƒâ€ Ã¢â‚¬â„¢ÃƒÆ’Ã‚Â¢ÃƒÂ¢Ã¢â‚¬Å¡Ã‚Â¬Ãƒâ€¦Ã‚Â¡ÃƒÆ’Ã†â€™ÃƒÂ¢Ã¢â€šÂ¬Ã…Â¡ÃƒÆ’Ã¢â‚¬Å¡Ãƒâ€šÃ‚Â¢ÃƒÆ’Ã†â€™Ãƒâ€ Ã¢â‚¬â„¢ÃƒÆ’Ã¢â‚¬Â ÃƒÂ¢Ã¢â€šÂ¬Ã¢â€žÂ¢ÃƒÆ’Ã†â€™ÃƒÂ¢Ã¢â€šÂ¬Ã…Â¡ÃƒÆ’Ã¢â‚¬Å¡Ãƒâ€šÃ‚Â¢ÃƒÆ’Ã†â€™Ãƒâ€ Ã¢â‚¬â„¢ÃƒÆ’Ã¢â‚¬Å¡Ãƒâ€šÃ‚Â¢ÃƒÆ’Ã†â€™Ãƒâ€šÃ‚Â¢ÃƒÆ’Ã‚Â¢ÃƒÂ¢Ã¢â€šÂ¬Ã…Â¡Ãƒâ€šÃ‚Â¬ÃƒÆ’Ã¢â‚¬Â¦Ãƒâ€šÃ‚Â¡ÃƒÆ’Ã†â€™ÃƒÂ¢Ã¢â€šÂ¬Ã…Â¡ÃƒÆ’Ã¢â‚¬Å¡Ãƒâ€šÃ‚Â¬ÃƒÆ’Ã†â€™Ãƒâ€ Ã¢â‚¬â„¢ÃƒÆ’Ã‚Â¢ÃƒÂ¢Ã¢â‚¬Å¡Ã‚Â¬Ãƒâ€šÃ‚Â¦ÃƒÆ’Ã†â€™ÃƒÂ¢Ã¢â€šÂ¬Ã…Â¡ÃƒÆ’Ã¢â‚¬Å¡Ãƒâ€šÃ‚Â¡ÃƒÆ’Ã†â€™Ãƒâ€ Ã¢â‚¬â„¢ÃƒÆ’Ã¢â‚¬Â ÃƒÂ¢Ã¢â€šÂ¬Ã¢â€žÂ¢ÃƒÆ’Ã†â€™Ãƒâ€šÃ‚Â¢ÃƒÆ’Ã‚Â¢ÃƒÂ¢Ã¢â€šÂ¬Ã…Â¡Ãƒâ€šÃ‚Â¬ÃƒÆ’Ã¢â‚¬Â¦Ãƒâ€šÃ‚Â¡ÃƒÆ’Ã†â€™Ãƒâ€ Ã¢â‚¬â„¢ÃƒÆ’Ã‚Â¢ÃƒÂ¢Ã¢â‚¬Å¡Ã‚Â¬Ãƒâ€¦Ã‚Â¡ÃƒÆ’Ã†â€™ÃƒÂ¢Ã¢â€šÂ¬Ã…Â¡ÃƒÆ’Ã¢â‚¬Å¡Ãƒâ€šÃ‚Â¬ÃƒÆ’Ã†â€™Ãƒâ€ Ã¢â‚¬â„¢ÃƒÆ’Ã¢â‚¬Â ÃƒÂ¢Ã¢â€šÂ¬Ã¢â€žÂ¢ÃƒÆ’Ã†â€™ÃƒÂ¢Ã¢â€šÂ¬Ã‚Â ÃƒÆ’Ã‚Â¢ÃƒÂ¢Ã¢â‚¬Å¡Ã‚Â¬ÃƒÂ¢Ã¢â‚¬Å¾Ã‚Â¢ÃƒÆ’Ã†â€™Ãƒâ€ Ã¢â‚¬â„¢ÃƒÆ’Ã¢â‚¬Å¡Ãƒâ€šÃ‚Â¢ÃƒÆ’Ã†â€™Ãƒâ€šÃ‚Â¢ÃƒÆ’Ã‚Â¢ÃƒÂ¢Ã¢â‚¬Å¡Ã‚Â¬Ãƒâ€¦Ã‚Â¡ÃƒÆ’Ã¢â‚¬Å¡Ãƒâ€šÃ‚Â¬ÃƒÆ’Ã†â€™ÃƒÂ¢Ã¢â€šÂ¬Ã…Â¡ÃƒÆ’Ã¢â‚¬Å¡Ãƒâ€šÃ‚Â¦ÃƒÆ’Ã†â€™Ãƒâ€ Ã¢â‚¬â„¢ÃƒÆ’Ã¢â‚¬Â ÃƒÂ¢Ã¢â€šÂ¬Ã¢â€žÂ¢ÃƒÆ’Ã†â€™Ãƒâ€šÃ‚Â¢ÃƒÆ’Ã‚Â¢ÃƒÂ¢Ã¢â€šÂ¬Ã…Â¡Ãƒâ€šÃ‚Â¬ÃƒÆ’Ã¢â‚¬Â¦Ãƒâ€šÃ‚Â¡ÃƒÆ’Ã†â€™Ãƒâ€ Ã¢â‚¬â„¢ÃƒÆ’Ã‚Â¢ÃƒÂ¢Ã¢â‚¬Å¡Ã‚Â¬Ãƒâ€¦Ã‚Â¡ÃƒÆ’Ã†â€™ÃƒÂ¢Ã¢â€šÂ¬Ã…Â¡ÃƒÆ’Ã¢â‚¬Å¡Ãƒâ€šÃ‚Â¡ÃƒÆ’Ã†â€™Ãƒâ€ Ã¢â‚¬â„¢ÃƒÆ’Ã¢â‚¬Â ÃƒÂ¢Ã¢â€šÂ¬Ã¢â€žÂ¢ÃƒÆ’Ã†â€™ÃƒÂ¢Ã¢â€šÂ¬Ã‚Â ÃƒÆ’Ã‚Â¢ÃƒÂ¢Ã¢â‚¬Å¡Ã‚Â¬ÃƒÂ¢Ã¢â‚¬Å¾Ã‚Â¢ÃƒÆ’Ã†â€™Ãƒâ€ Ã¢â‚¬â„¢ÃƒÆ’Ã‚Â¢ÃƒÂ¢Ã¢â‚¬Å¡Ã‚Â¬Ãƒâ€šÃ‚Â ÃƒÆ’Ã†â€™Ãƒâ€šÃ‚Â¢ÃƒÆ’Ã‚Â¢ÃƒÂ¢Ã¢â€šÂ¬Ã…Â¡Ãƒâ€šÃ‚Â¬ÃƒÆ’Ã‚Â¢ÃƒÂ¢Ã¢â€šÂ¬Ã…Â¾Ãƒâ€šÃ‚Â¢ÃƒÆ’Ã†â€™Ãƒâ€ Ã¢â‚¬â„¢ÃƒÆ’Ã¢â‚¬Â ÃƒÂ¢Ã¢â€šÂ¬Ã¢â€žÂ¢ÃƒÆ’Ã†â€™Ãƒâ€šÃ‚Â¢ÃƒÆ’Ã‚Â¢ÃƒÂ¢Ã¢â€šÂ¬Ã…Â¡Ãƒâ€šÃ‚Â¬ÃƒÆ’Ã¢â‚¬Å¡Ãƒâ€šÃ‚Â ÃƒÆ’Ã†â€™Ãƒâ€ Ã¢â‚¬â„¢ÃƒÆ’Ã¢â‚¬Å¡Ãƒâ€šÃ‚Â¢ÃƒÆ’Ã†â€™Ãƒâ€šÃ‚Â¢ÃƒÆ’Ã‚Â¢ÃƒÂ¢Ã¢â‚¬Å¡Ã‚Â¬Ãƒâ€¦Ã‚Â¡ÃƒÆ’Ã¢â‚¬Å¡Ãƒâ€šÃ‚Â¬ÃƒÆ’Ã†â€™Ãƒâ€šÃ‚Â¢ÃƒÆ’Ã‚Â¢ÃƒÂ¢Ã¢â‚¬Å¡Ã‚Â¬Ãƒâ€¦Ã‚Â¾ÃƒÆ’Ã¢â‚¬Å¡Ãƒâ€šÃ‚Â¢ÃƒÆ’Ã†â€™Ãƒâ€ Ã¢â‚¬â„¢ÃƒÆ’Ã¢â‚¬Â ÃƒÂ¢Ã¢â€šÂ¬Ã¢â€žÂ¢ÃƒÆ’Ã†â€™ÃƒÂ¢Ã¢â€šÂ¬Ã‚Â ÃƒÆ’Ã‚Â¢ÃƒÂ¢Ã¢â‚¬Å¡Ã‚Â¬ÃƒÂ¢Ã¢â‚¬Å¾Ã‚Â¢ÃƒÆ’Ã†â€™Ãƒâ€ Ã¢â‚¬â„¢ÃƒÆ’Ã‚Â¢ÃƒÂ¢Ã¢â‚¬Å¡Ã‚Â¬Ãƒâ€¦Ã‚Â¡ÃƒÆ’Ã†â€™ÃƒÂ¢Ã¢â€šÂ¬Ã…Â¡ÃƒÆ’Ã¢â‚¬Å¡Ãƒâ€šÃ‚Â¢ÃƒÆ’Ã†â€™Ãƒâ€ Ã¢â‚¬â„¢ÃƒÆ’Ã¢â‚¬Â ÃƒÂ¢Ã¢â€šÂ¬Ã¢â€žÂ¢ÃƒÆ’Ã†â€™ÃƒÂ¢Ã¢â€šÂ¬Ã…Â¡ÃƒÆ’Ã¢â‚¬Å¡Ãƒâ€šÃ‚Â¢ÃƒÆ’Ã†â€™Ãƒâ€ Ã¢â‚¬â„¢ÃƒÆ’Ã¢â‚¬Å¡Ãƒâ€šÃ‚Â¢ÃƒÆ’Ã†â€™Ãƒâ€šÃ‚Â¢ÃƒÆ’Ã‚Â¢ÃƒÂ¢Ã¢â‚¬Å¡Ã‚Â¬Ãƒâ€¦Ã‚Â¡ÃƒÆ’Ã¢â‚¬Å¡Ãƒâ€šÃ‚Â¬ÃƒÆ’Ã†â€™ÃƒÂ¢Ã¢â€šÂ¬Ã‚Â¦ÃƒÆ’Ã¢â‚¬Å¡Ãƒâ€šÃ‚Â¡ÃƒÆ’Ã†â€™Ãƒâ€ Ã¢â‚¬â„¢ÃƒÆ’Ã‚Â¢ÃƒÂ¢Ã¢â‚¬Å¡Ã‚Â¬Ãƒâ€¦Ã‚Â¡ÃƒÆ’Ã†â€™ÃƒÂ¢Ã¢â€šÂ¬Ã…Â¡ÃƒÆ’Ã¢â‚¬Å¡Ãƒâ€šÃ‚Â¬ÃƒÆ’Ã†â€™Ãƒâ€ Ã¢â‚¬â„¢ÃƒÆ’Ã¢â‚¬Â ÃƒÂ¢Ã¢â€šÂ¬Ã¢â€žÂ¢ÃƒÆ’Ã†â€™Ãƒâ€šÃ‚Â¢ÃƒÆ’Ã‚Â¢ÃƒÂ¢Ã¢â€šÂ¬Ã…Â¡Ãƒâ€šÃ‚Â¬ÃƒÆ’Ã¢â‚¬Å¡Ãƒâ€šÃ‚Â¦ÃƒÆ’Ã†â€™Ãƒâ€ Ã¢â‚¬â„¢ÃƒÆ’Ã‚Â¢ÃƒÂ¢Ã¢â‚¬Å¡Ã‚Â¬Ãƒâ€¦Ã‚Â¡ÃƒÆ’Ã†â€™ÃƒÂ¢Ã¢â€šÂ¬Ã…Â¡ÃƒÆ’Ã¢â‚¬Å¡Ãƒâ€šÃ‚Â¡ÃƒÆ’Ã†â€™Ãƒâ€ Ã¢â‚¬â„¢ÃƒÆ’Ã¢â‚¬Â ÃƒÂ¢Ã¢â€šÂ¬Ã¢â€žÂ¢ÃƒÆ’Ã†â€™ÃƒÂ¢Ã¢â€šÂ¬Ã‚Â ÃƒÆ’Ã‚Â¢ÃƒÂ¢Ã¢â‚¬Å¡Ã‚Â¬ÃƒÂ¢Ã¢â‚¬Å¾Ã‚Â¢ÃƒÆ’Ã†â€™Ãƒâ€ Ã¢â‚¬â„¢ÃƒÆ’Ã‚Â¢ÃƒÂ¢Ã¢â‚¬Å¡Ã‚Â¬Ãƒâ€šÃ‚Â ÃƒÆ’Ã†â€™Ãƒâ€šÃ‚Â¢ÃƒÆ’Ã‚Â¢ÃƒÂ¢Ã¢â€šÂ¬Ã…Â¡Ãƒâ€šÃ‚Â¬ÃƒÆ’Ã‚Â¢ÃƒÂ¢Ã¢â€šÂ¬Ã…Â¾Ãƒâ€šÃ‚Â¢ÃƒÆ’Ã†â€™Ãƒâ€ Ã¢â‚¬â„¢ÃƒÆ’Ã¢â‚¬Â ÃƒÂ¢Ã¢â€šÂ¬Ã¢â€žÂ¢ÃƒÆ’Ã†â€™ÃƒÂ¢Ã¢â€šÂ¬Ã…Â¡ÃƒÆ’Ã¢â‚¬Å¡Ãƒâ€šÃ‚Â¢ÃƒÆ’Ã†â€™Ãƒâ€ Ã¢â‚¬â„¢ÃƒÆ’Ã¢â‚¬Å¡Ãƒâ€šÃ‚Â¢ÃƒÆ’Ã†â€™Ãƒâ€šÃ‚Â¢ÃƒÆ’Ã‚Â¢ÃƒÂ¢Ã¢â€šÂ¬Ã…Â¡Ãƒâ€šÃ‚Â¬ÃƒÆ’Ã¢â‚¬Â¦Ãƒâ€šÃ‚Â¡ÃƒÆ’Ã†â€™ÃƒÂ¢Ã¢â€šÂ¬Ã…Â¡ÃƒÆ’Ã¢â‚¬Å¡Ãƒâ€šÃ‚Â¬ÃƒÆ’Ã†â€™Ãƒâ€ Ã¢â‚¬â„¢ÃƒÆ’Ã‚Â¢ÃƒÂ¢Ã¢â‚¬Å¡Ã‚Â¬Ãƒâ€šÃ‚Â¦ÃƒÆ’Ã†â€™ÃƒÂ¢Ã¢â€šÂ¬Ã…Â¡ÃƒÆ’Ã¢â‚¬Å¡Ãƒâ€šÃ‚Â¡ÃƒÆ’Ã†â€™Ãƒâ€ Ã¢â‚¬â„¢ÃƒÆ’Ã¢â‚¬Â ÃƒÂ¢Ã¢â€šÂ¬Ã¢â€žÂ¢ÃƒÆ’Ã†â€™ÃƒÂ¢Ã¢â€šÂ¬Ã‚Â ÃƒÆ’Ã‚Â¢ÃƒÂ¢Ã¢â‚¬Å¡Ã‚Â¬ÃƒÂ¢Ã¢â‚¬Å¾Ã‚Â¢ÃƒÆ’Ã†â€™Ãƒâ€ Ã¢â‚¬â„¢ÃƒÆ’Ã¢â‚¬Å¡Ãƒâ€šÃ‚Â¢ÃƒÆ’Ã†â€™Ãƒâ€šÃ‚Â¢ÃƒÆ’Ã‚Â¢ÃƒÂ¢Ã¢â‚¬Å¡Ã‚Â¬Ãƒâ€¦Ã‚Â¡ÃƒÆ’Ã¢â‚¬Å¡Ãƒâ€šÃ‚Â¬ÃƒÆ’Ã†â€™ÃƒÂ¢Ã¢â€šÂ¬Ã‚Â¦ÃƒÆ’Ã¢â‚¬Å¡Ãƒâ€šÃ‚Â¡ÃƒÆ’Ã†â€™Ãƒâ€ Ã¢â‚¬â„¢ÃƒÆ’Ã¢â‚¬Â ÃƒÂ¢Ã¢â€šÂ¬Ã¢â€žÂ¢ÃƒÆ’Ã†â€™Ãƒâ€šÃ‚Â¢ÃƒÆ’Ã‚Â¢ÃƒÂ¢Ã¢â€šÂ¬Ã…Â¡Ãƒâ€šÃ‚Â¬ÃƒÆ’Ã¢â‚¬Â¦Ãƒâ€šÃ‚Â¡ÃƒÆ’Ã†â€™Ãƒâ€ Ã¢â‚¬â„¢ÃƒÆ’Ã‚Â¢ÃƒÂ¢Ã¢â‚¬Å¡Ã‚Â¬Ãƒâ€¦Ã‚Â¡ÃƒÆ’Ã†â€™ÃƒÂ¢Ã¢â€šÂ¬Ã…Â¡ÃƒÆ’Ã¢â‚¬Å¡Ãƒâ€šÃ‚Â°C by Week 7. Similarly, pH remained consistently alkaline throughout the study, with both treatments peaking in Week 4 (IMTA: 8.35; Monoculture: 8.37) and then gradually declining and stabilizing. From Week 3 onward, the IMTA system generally maintained slightly lower pH values compared to the Monoculture system.</w:t>
       </w:r>
     </w:p>
     <w:p>
@@ -8258,7 +8258,7 @@
           <w:sz w:val="28"/>
           <w:szCs w:val="28"/>
         </w:rPr>
-        <w:t>ÃƒÆ’Ã†â€™Ãƒâ€ Ã¢â‚¬â„¢ÃƒÆ’Ã¢â‚¬Â ÃƒÂ¢Ã¢â€šÂ¬Ã¢â€žÂ¢ÃƒÆ’Ã†â€™ÃƒÂ¢Ã¢â€šÂ¬Ã‚Â ÃƒÆ’Ã‚Â¢ÃƒÂ¢Ã¢â‚¬Å¡Ã‚Â¬ÃƒÂ¢Ã¢â‚¬Å¾Ã‚Â¢ÃƒÆ’Ã†â€™Ãƒâ€ Ã¢â‚¬â„¢ÃƒÆ’Ã‚Â¢ÃƒÂ¢Ã¢â‚¬Å¡Ã‚Â¬Ãƒâ€šÃ‚Â ÃƒÆ’Ã†â€™Ãƒâ€šÃ‚Â¢ÃƒÆ’Ã‚Â¢ÃƒÂ¢Ã¢â€šÂ¬Ã…Â¡Ãƒâ€šÃ‚Â¬ÃƒÆ’Ã‚Â¢ÃƒÂ¢Ã¢â€šÂ¬Ã…Â¾Ãƒâ€šÃ‚Â¢ÃƒÆ’Ã†â€™Ãƒâ€ Ã¢â‚¬â„¢ÃƒÆ’Ã¢â‚¬Â ÃƒÂ¢Ã¢â€šÂ¬Ã¢â€žÂ¢ÃƒÆ’Ã†â€™Ãƒâ€šÃ‚Â¢ÃƒÆ’Ã‚Â¢ÃƒÂ¢Ã¢â€šÂ¬Ã…Â¡Ãƒâ€šÃ‚Â¬ÃƒÆ’Ã¢â‚¬Å¡Ãƒâ€šÃ‚Â ÃƒÆ’Ã†â€™Ãƒâ€ Ã¢â‚¬â„¢ÃƒÆ’Ã¢â‚¬Å¡Ãƒâ€šÃ‚Â¢ÃƒÆ’Ã†â€™Ãƒâ€šÃ‚Â¢ÃƒÆ’Ã‚Â¢ÃƒÂ¢Ã¢â‚¬Å¡Ã‚Â¬Ãƒâ€¦Ã‚Â¡ÃƒÆ’Ã¢â‚¬Å¡Ãƒâ€šÃ‚Â¬ÃƒÆ’Ã†â€™Ãƒâ€šÃ‚Â¢ÃƒÆ’Ã‚Â¢ÃƒÂ¢Ã¢â‚¬Å¡Ã‚Â¬Ãƒâ€¦Ã‚Â¾ÃƒÆ’Ã¢â‚¬Å¡Ãƒâ€šÃ‚Â¢ÃƒÆ’Ã†â€™Ãƒâ€ Ã¢â‚¬â„¢ÃƒÆ’Ã¢â‚¬Â ÃƒÂ¢Ã¢â€šÂ¬Ã¢â€žÂ¢ÃƒÆ’Ã†â€™ÃƒÂ¢Ã¢â€šÂ¬Ã‚Â ÃƒÆ’Ã‚Â¢ÃƒÂ¢Ã¢â‚¬Å¡Ã‚Â¬ÃƒÂ¢Ã¢â‚¬Å¾Ã‚Â¢ÃƒÆ’Ã†â€™Ãƒâ€ Ã¢â‚¬â„¢ÃƒÆ’Ã¢â‚¬Å¡Ãƒâ€šÃ‚Â¢ÃƒÆ’Ã†â€™Ãƒâ€šÃ‚Â¢ÃƒÆ’Ã‚Â¢ÃƒÂ¢Ã¢â‚¬Å¡Ã‚Â¬Ãƒâ€¦Ã‚Â¡ÃƒÆ’Ã¢â‚¬Å¡Ãƒâ€šÃ‚Â¬ÃƒÆ’Ã†â€™ÃƒÂ¢Ã¢â€šÂ¬Ã…Â¡ÃƒÆ’Ã¢â‚¬Å¡Ãƒâ€šÃ‚Â¦ÃƒÆ’Ã†â€™Ãƒâ€ Ã¢â‚¬â„¢ÃƒÆ’Ã¢â‚¬Â ÃƒÂ¢Ã¢â€šÂ¬Ã¢â€žÂ¢ÃƒÆ’Ã†â€™Ãƒâ€šÃ‚Â¢ÃƒÆ’Ã‚Â¢ÃƒÂ¢Ã¢â€šÂ¬Ã…Â¡Ãƒâ€šÃ‚Â¬ÃƒÆ’Ã¢â‚¬Â¦Ãƒâ€šÃ‚Â¡ÃƒÆ’Ã†â€™Ãƒâ€ Ã¢â‚¬â„¢ÃƒÆ’Ã‚Â¢ÃƒÂ¢Ã¢â‚¬Å¡Ã‚Â¬Ãƒâ€¦Ã‚Â¡ÃƒÆ’Ã†â€™ÃƒÂ¢Ã¢â€šÂ¬Ã…Â¡ÃƒÆ’Ã¢â‚¬Å¡Ãƒâ€šÃ‚Â½ÃƒÆ’Ã†â€™Ãƒâ€ Ã¢â‚¬â„¢ÃƒÆ’Ã¢â‚¬Â ÃƒÂ¢Ã¢â€šÂ¬Ã¢â€žÂ¢ÃƒÆ’Ã†â€™ÃƒÂ¢Ã¢â€šÂ¬Ã‚Â ÃƒÆ’Ã‚Â¢ÃƒÂ¢Ã¢â‚¬Å¡Ã‚Â¬ÃƒÂ¢Ã¢â‚¬Å¾Ã‚Â¢ÃƒÆ’Ã†â€™Ãƒâ€ Ã¢â‚¬â„¢ÃƒÆ’Ã‚Â¢ÃƒÂ¢Ã¢â‚¬Å¡Ã‚Â¬Ãƒâ€šÃ‚Â ÃƒÆ’Ã†â€™Ãƒâ€šÃ‚Â¢ÃƒÆ’Ã‚Â¢ÃƒÂ¢Ã¢â€šÂ¬Ã…Â¡Ãƒâ€šÃ‚Â¬ÃƒÆ’Ã‚Â¢ÃƒÂ¢Ã¢â€šÂ¬Ã…Â¾Ãƒâ€šÃ‚Â¢ÃƒÆ’Ã†â€™Ãƒâ€ Ã¢â‚¬â„¢ÃƒÆ’Ã¢â‚¬Â ÃƒÂ¢Ã¢â€šÂ¬Ã¢â€žÂ¢ÃƒÆ’Ã†â€™ÃƒÂ¢Ã¢â€šÂ¬Ã…Â¡ÃƒÆ’Ã¢â‚¬Å¡Ãƒâ€šÃ‚Â¢ÃƒÆ’Ã†â€™Ãƒâ€ Ã¢â‚¬â„¢ÃƒÆ’Ã¢â‚¬Å¡Ãƒâ€šÃ‚Â¢ÃƒÆ’Ã†â€™Ãƒâ€šÃ‚Â¢ÃƒÆ’Ã‚Â¢ÃƒÂ¢Ã¢â€šÂ¬Ã…Â¡Ãƒâ€šÃ‚Â¬ÃƒÆ’Ã¢â‚¬Â¦Ãƒâ€šÃ‚Â¡ÃƒÆ’Ã†â€™ÃƒÂ¢Ã¢â€šÂ¬Ã…Â¡ÃƒÆ’Ã¢â‚¬Å¡Ãƒâ€šÃ‚Â¬ÃƒÆ’Ã†â€™Ãƒâ€ Ã¢â‚¬â„¢ÃƒÆ’Ã‚Â¢ÃƒÂ¢Ã¢â‚¬Å¡Ã‚Â¬Ãƒâ€šÃ‚Â¦ÃƒÆ’Ã†â€™ÃƒÂ¢Ã¢â€šÂ¬Ã…Â¡ÃƒÆ’Ã¢â‚¬Å¡Ãƒâ€šÃ‚Â¡ÃƒÆ’Ã†â€™Ãƒâ€ Ã¢â‚¬â„¢ÃƒÆ’Ã¢â‚¬Â ÃƒÂ¢Ã¢â€šÂ¬Ã¢â€žÂ¢ÃƒÆ’Ã†â€™ÃƒÂ¢Ã¢â€šÂ¬Ã‚Â ÃƒÆ’Ã‚Â¢ÃƒÂ¢Ã¢â‚¬Å¡Ã‚Â¬ÃƒÂ¢Ã¢â‚¬Å¾Ã‚Â¢ÃƒÆ’Ã†â€™Ãƒâ€ Ã¢â‚¬â„¢ÃƒÆ’Ã¢â‚¬Å¡Ãƒâ€šÃ‚Â¢ÃƒÆ’Ã†â€™Ãƒâ€šÃ‚Â¢ÃƒÆ’Ã‚Â¢ÃƒÂ¢Ã¢â‚¬Å¡Ã‚Â¬Ãƒâ€¦Ã‚Â¡ÃƒÆ’Ã¢â‚¬Å¡Ãƒâ€šÃ‚Â¬ÃƒÆ’Ã†â€™ÃƒÂ¢Ã¢â€šÂ¬Ã‚Â¦ÃƒÆ’Ã¢â‚¬Å¡Ãƒâ€šÃ‚Â¡ÃƒÆ’Ã†â€™Ãƒâ€ Ã¢â‚¬â„¢ÃƒÆ’Ã¢â‚¬Â ÃƒÂ¢Ã¢â€šÂ¬Ã¢â€žÂ¢ÃƒÆ’Ã†â€™Ãƒâ€šÃ‚Â¢ÃƒÆ’Ã‚Â¢ÃƒÂ¢Ã¢â€šÂ¬Ã…Â¡Ãƒâ€šÃ‚Â¬ÃƒÆ’Ã¢â‚¬Â¦Ãƒâ€šÃ‚Â¡ÃƒÆ’Ã†â€™Ãƒâ€ Ã¢â‚¬â„¢ÃƒÆ’Ã‚Â¢ÃƒÂ¢Ã¢â‚¬Å¡Ã‚Â¬Ãƒâ€¦Ã‚Â¡ÃƒÆ’Ã†â€™ÃƒÂ¢Ã¢â€šÂ¬Ã…Â¡ÃƒÆ’Ã¢â‚¬Å¡Ãƒâ€šÃ‚Â¼g</w:t>
+        <w:t>ÃƒÆ’Ã†â€™Ãƒâ€ Ã¢â‚¬â„¢ÃƒÆ’Ã¢â‚¬Â ÃƒÂ¢Ã¢â€šÂ¬Ã¢â€žÂ¢ÃƒÆ’Ã†â€™ÃƒÂ¢Ã¢â€šÂ¬Ã‚Â ÃƒÆ’Ã‚Â¢ÃƒÂ¢Ã¢â‚¬Å¡Ã‚Â¬ÃƒÂ¢Ã¢â‚¬Å¾Ã‚Â¢ÃƒÆ’Ã†â€™Ãƒâ€ Ã¢â‚¬â„¢ÃƒÆ’Ã‚Â¢ÃƒÂ¢Ã¢â‚¬Å¡Ã‚Â¬Ãƒâ€šÃ‚Â ÃƒÆ’Ã†â€™Ãƒâ€šÃ‚Â¢ÃƒÆ’Ã‚Â¢ÃƒÂ¢Ã¢â€šÂ¬Ã…Â¡Ãƒâ€šÃ‚Â¬ÃƒÆ’Ã‚Â¢ÃƒÂ¢Ã¢â€šÂ¬Ã…Â¾Ãƒâ€šÃ‚Â¢ÃƒÆ’Ã†â€™Ãƒâ€ Ã¢â‚¬â„¢ÃƒÆ’Ã¢â‚¬Â ÃƒÂ¢Ã¢â€šÂ¬Ã¢â€žÂ¢ÃƒÆ’Ã†â€™Ãƒâ€šÃ‚Â¢ÃƒÆ’Ã‚Â¢ÃƒÂ¢Ã¢â€šÂ¬Ã…Â¡Ãƒâ€šÃ‚Â¬ÃƒÆ’Ã¢â‚¬Å¡Ãƒâ€šÃ‚Â ÃƒÆ’Ã†â€™Ãƒâ€ Ã¢â‚¬â„¢ÃƒÆ’Ã¢â‚¬Å¡Ãƒâ€šÃ‚Â¢ÃƒÆ’Ã†â€™Ãƒâ€šÃ‚Â¢ÃƒÆ’Ã‚Â¢ÃƒÂ¢Ã¢â‚¬Å¡Ã‚Â¬Ãƒâ€¦Ã‚Â¡ÃƒÆ’Ã¢â‚¬Å¡Ãƒâ€šÃ‚Â¬ÃƒÆ’Ã†â€™Ãƒâ€šÃ‚Â¢ÃƒÆ’Ã‚Â¢ÃƒÂ¢Ã¢â‚¬Å¡Ã‚Â¬Ãƒâ€¦Ã‚Â¾ÃƒÆ’Ã¢â‚¬Å¡Ãƒâ€šÃ‚Â¢ÃƒÆ’Ã†â€™Ãƒâ€ Ã¢â‚¬â„¢ÃƒÆ’Ã¢â‚¬Â ÃƒÂ¢Ã¢â€šÂ¬Ã¢â€žÂ¢ÃƒÆ’Ã†â€™ÃƒÂ¢Ã¢â€šÂ¬Ã‚Â ÃƒÆ’Ã‚Â¢ÃƒÂ¢Ã¢â‚¬Å¡Ã‚Â¬ÃƒÂ¢Ã¢â‚¬Å¾Ã‚Â¢ÃƒÆ’Ã†â€™Ãƒâ€ Ã¢â‚¬â„¢ÃƒÆ’Ã¢â‚¬Å¡Ãƒâ€šÃ‚Â¢ÃƒÆ’Ã†â€™Ãƒâ€šÃ‚Â¢ÃƒÆ’Ã‚Â¢ÃƒÂ¢Ã¢â‚¬Å¡Ã‚Â¬Ãƒâ€¦Ã‚Â¡ÃƒÆ’Ã¢â‚¬Å¡Ãƒâ€šÃ‚Â¬ÃƒÆ’Ã†â€™ÃƒÂ¢Ã¢â€šÂ¬Ã…Â¡ÃƒÆ’Ã¢â‚¬Å¡Ãƒâ€šÃ‚Â ÃƒÆ’Ã†â€™Ãƒâ€ Ã¢â‚¬â„¢ÃƒÆ’Ã¢â‚¬Â ÃƒÂ¢Ã¢â€šÂ¬Ã¢â€žÂ¢ÃƒÆ’Ã†â€™ÃƒÂ¢Ã¢â€šÂ¬Ã…Â¡ÃƒÆ’Ã¢â‚¬Å¡Ãƒâ€šÃ‚Â¢ÃƒÆ’Ã†â€™Ãƒâ€ Ã¢â‚¬â„¢ÃƒÆ’Ã¢â‚¬Å¡Ãƒâ€šÃ‚Â¢ÃƒÆ’Ã†â€™Ãƒâ€šÃ‚Â¢ÃƒÆ’Ã‚Â¢ÃƒÂ¢Ã¢â€šÂ¬Ã…Â¡Ãƒâ€šÃ‚Â¬ÃƒÆ’Ã¢â‚¬Â¦Ãƒâ€šÃ‚Â¡ÃƒÆ’Ã†â€™ÃƒÂ¢Ã¢â€šÂ¬Ã…Â¡ÃƒÆ’Ã¢â‚¬Å¡Ãƒâ€šÃ‚Â¬ÃƒÆ’Ã†â€™Ãƒâ€ Ã¢â‚¬â„¢ÃƒÆ’Ã¢â‚¬Å¡Ãƒâ€šÃ‚Â¢ÃƒÆ’Ã†â€™Ãƒâ€šÃ‚Â¢ÃƒÆ’Ã‚Â¢ÃƒÂ¢Ã¢â€šÂ¬Ã…Â¡Ãƒâ€šÃ‚Â¬ÃƒÆ’Ã¢â‚¬Â¦Ãƒâ€šÃ‚Â¾ÃƒÆ’Ã†â€™ÃƒÂ¢Ã¢â€šÂ¬Ã…Â¡ÃƒÆ’Ã¢â‚¬Å¡Ãƒâ€šÃ‚Â¢ÃƒÆ’Ã†â€™Ãƒâ€ Ã¢â‚¬â„¢ÃƒÆ’Ã¢â‚¬Â ÃƒÂ¢Ã¢â€šÂ¬Ã¢â€žÂ¢ÃƒÆ’Ã†â€™ÃƒÂ¢Ã¢â€šÂ¬Ã‚Â ÃƒÆ’Ã‚Â¢ÃƒÂ¢Ã¢â‚¬Å¡Ã‚Â¬ÃƒÂ¢Ã¢â‚¬Å¾Ã‚Â¢ÃƒÆ’Ã†â€™Ãƒâ€ Ã¢â‚¬â„¢ÃƒÆ’Ã‚Â¢ÃƒÂ¢Ã¢â‚¬Å¡Ã‚Â¬Ãƒâ€šÃ‚Â ÃƒÆ’Ã†â€™Ãƒâ€šÃ‚Â¢ÃƒÆ’Ã‚Â¢ÃƒÂ¢Ã¢â€šÂ¬Ã…Â¡Ãƒâ€šÃ‚Â¬ÃƒÆ’Ã‚Â¢ÃƒÂ¢Ã¢â€šÂ¬Ã…Â¾Ãƒâ€šÃ‚Â¢ÃƒÆ’Ã†â€™Ãƒâ€ Ã¢â‚¬â„¢ÃƒÆ’Ã¢â‚¬Â ÃƒÂ¢Ã¢â€šÂ¬Ã¢â€žÂ¢ÃƒÆ’Ã†â€™ÃƒÂ¢Ã¢â€šÂ¬Ã…Â¡ÃƒÆ’Ã¢â‚¬Å¡Ãƒâ€šÃ‚Â¢ÃƒÆ’Ã†â€™Ãƒâ€ Ã¢â‚¬â„¢ÃƒÆ’Ã¢â‚¬Å¡Ãƒâ€šÃ‚Â¢ÃƒÆ’Ã†â€™Ãƒâ€šÃ‚Â¢ÃƒÆ’Ã‚Â¢ÃƒÂ¢Ã¢â€šÂ¬Ã…Â¡Ãƒâ€šÃ‚Â¬ÃƒÆ’Ã¢â‚¬Â¦Ãƒâ€šÃ‚Â¡ÃƒÆ’Ã†â€™ÃƒÂ¢Ã¢â€šÂ¬Ã…Â¡ÃƒÆ’Ã¢â‚¬Å¡Ãƒâ€šÃ‚Â¬ÃƒÆ’Ã†â€™Ãƒâ€ Ã¢â‚¬â„¢ÃƒÆ’Ã‚Â¢ÃƒÂ¢Ã¢â‚¬Å¡Ã‚Â¬Ãƒâ€¦Ã‚Â¡ÃƒÆ’Ã†â€™ÃƒÂ¢Ã¢â€šÂ¬Ã…Â¡ÃƒÆ’Ã¢â‚¬Å¡Ãƒâ€šÃ‚Â¦ÃƒÆ’Ã†â€™Ãƒâ€ Ã¢â‚¬â„¢ÃƒÆ’Ã¢â‚¬Â ÃƒÂ¢Ã¢â€šÂ¬Ã¢â€žÂ¢ÃƒÆ’Ã†â€™ÃƒÂ¢Ã¢â€šÂ¬Ã‚Â ÃƒÆ’Ã‚Â¢ÃƒÂ¢Ã¢â‚¬Å¡Ã‚Â¬ÃƒÂ¢Ã¢â‚¬Å¾Ã‚Â¢ÃƒÆ’Ã†â€™Ãƒâ€ Ã¢â‚¬â„¢ÃƒÆ’Ã¢â‚¬Å¡Ãƒâ€šÃ‚Â¢ÃƒÆ’Ã†â€™Ãƒâ€šÃ‚Â¢ÃƒÆ’Ã‚Â¢ÃƒÂ¢Ã¢â‚¬Å¡Ã‚Â¬Ãƒâ€¦Ã‚Â¡ÃƒÆ’Ã¢â‚¬Å¡Ãƒâ€šÃ‚Â¬ÃƒÆ’Ã†â€™ÃƒÂ¢Ã¢â€šÂ¬Ã‚Â¦ÃƒÆ’Ã¢â‚¬Å¡Ãƒâ€šÃ‚Â¡ÃƒÆ’Ã†â€™Ãƒâ€ Ã¢â‚¬â„¢ÃƒÆ’Ã¢â‚¬Â ÃƒÂ¢Ã¢â€šÂ¬Ã¢â€žÂ¢ÃƒÆ’Ã†â€™Ãƒâ€šÃ‚Â¢ÃƒÆ’Ã‚Â¢ÃƒÂ¢Ã¢â€šÂ¬Ã…Â¡Ãƒâ€šÃ‚Â¬ÃƒÆ’Ã¢â‚¬Â¦Ãƒâ€šÃ‚Â¡ÃƒÆ’Ã†â€™Ãƒâ€ Ã¢â‚¬â„¢ÃƒÆ’Ã‚Â¢ÃƒÂ¢Ã¢â‚¬Å¡Ã‚Â¬Ãƒâ€¦Ã‚Â¡ÃƒÆ’Ã†â€™ÃƒÂ¢Ã¢â€šÂ¬Ã…Â¡ÃƒÆ’Ã¢â‚¬Å¡Ãƒâ€šÃ‚Â½ÃƒÆ’Ã†â€™Ãƒâ€ Ã¢â‚¬â„¢ÃƒÆ’Ã¢â‚¬Â ÃƒÂ¢Ã¢â€šÂ¬Ã¢â€žÂ¢ÃƒÆ’Ã†â€™ÃƒÂ¢Ã¢â€šÂ¬Ã‚Â ÃƒÆ’Ã‚Â¢ÃƒÂ¢Ã¢â‚¬Å¡Ã‚Â¬ÃƒÂ¢Ã¢â‚¬Å¾Ã‚Â¢ÃƒÆ’Ã†â€™Ãƒâ€ Ã¢â‚¬â„¢ÃƒÆ’Ã‚Â¢ÃƒÂ¢Ã¢â‚¬Å¡Ã‚Â¬Ãƒâ€šÃ‚Â ÃƒÆ’Ã†â€™Ãƒâ€šÃ‚Â¢ÃƒÆ’Ã‚Â¢ÃƒÂ¢Ã¢â€šÂ¬Ã…Â¡Ãƒâ€šÃ‚Â¬ÃƒÆ’Ã‚Â¢ÃƒÂ¢Ã¢â€šÂ¬Ã…Â¾Ãƒâ€šÃ‚Â¢ÃƒÆ’Ã†â€™Ãƒâ€ Ã¢â‚¬â„¢ÃƒÆ’Ã¢â‚¬Â ÃƒÂ¢Ã¢â€šÂ¬Ã¢â€žÂ¢ÃƒÆ’Ã†â€™Ãƒâ€šÃ‚Â¢ÃƒÆ’Ã‚Â¢ÃƒÂ¢Ã¢â€šÂ¬Ã…Â¡Ãƒâ€šÃ‚Â¬ÃƒÆ’Ã¢â‚¬Å¡Ãƒâ€šÃ‚Â ÃƒÆ’Ã†â€™Ãƒâ€ Ã¢â‚¬â„¢ÃƒÆ’Ã¢â‚¬Å¡Ãƒâ€šÃ‚Â¢ÃƒÆ’Ã†â€™Ãƒâ€šÃ‚Â¢ÃƒÆ’Ã‚Â¢ÃƒÂ¢Ã¢â‚¬Å¡Ã‚Â¬Ãƒâ€¦Ã‚Â¡ÃƒÆ’Ã¢â‚¬Å¡Ãƒâ€šÃ‚Â¬ÃƒÆ’Ã†â€™Ãƒâ€šÃ‚Â¢ÃƒÆ’Ã‚Â¢ÃƒÂ¢Ã¢â‚¬Å¡Ã‚Â¬Ãƒâ€¦Ã‚Â¾ÃƒÆ’Ã¢â‚¬Å¡Ãƒâ€šÃ‚Â¢ÃƒÆ’Ã†â€™Ãƒâ€ Ã¢â‚¬â„¢ÃƒÆ’Ã¢â‚¬Â ÃƒÂ¢Ã¢â€šÂ¬Ã¢â€žÂ¢ÃƒÆ’Ã†â€™ÃƒÂ¢Ã¢â€šÂ¬Ã‚Â ÃƒÆ’Ã‚Â¢ÃƒÂ¢Ã¢â‚¬Å¡Ã‚Â¬ÃƒÂ¢Ã¢â‚¬Å¾Ã‚Â¢ÃƒÆ’Ã†â€™Ãƒâ€ Ã¢â‚¬â„¢ÃƒÆ’Ã‚Â¢ÃƒÂ¢Ã¢â‚¬Å¡Ã‚Â¬Ãƒâ€¦Ã‚Â¡ÃƒÆ’Ã†â€™ÃƒÂ¢Ã¢â€šÂ¬Ã…Â¡ÃƒÆ’Ã¢â‚¬Å¡Ãƒâ€šÃ‚Â¢ÃƒÆ’Ã†â€™Ãƒâ€ Ã¢â‚¬â„¢ÃƒÆ’Ã¢â‚¬Â ÃƒÂ¢Ã¢â€šÂ¬Ã¢â€žÂ¢ÃƒÆ’Ã†â€™ÃƒÂ¢Ã¢â€šÂ¬Ã…Â¡ÃƒÆ’Ã¢â‚¬Å¡Ãƒâ€šÃ‚Â¢ÃƒÆ’Ã†â€™Ãƒâ€ Ã¢â‚¬â„¢ÃƒÆ’Ã¢â‚¬Å¡Ãƒâ€šÃ‚Â¢ÃƒÆ’Ã†â€™Ãƒâ€šÃ‚Â¢ÃƒÆ’Ã‚Â¢ÃƒÂ¢Ã¢â‚¬Å¡Ã‚Â¬Ãƒâ€¦Ã‚Â¡ÃƒÆ’Ã¢â‚¬Å¡Ãƒâ€šÃ‚Â¬ÃƒÆ’Ã†â€™ÃƒÂ¢Ã¢â€šÂ¬Ã‚Â¦ÃƒÆ’Ã¢â‚¬Å¡Ãƒâ€šÃ‚Â¡ÃƒÆ’Ã†â€™Ãƒâ€ Ã¢â‚¬â„¢ÃƒÆ’Ã‚Â¢ÃƒÂ¢Ã¢â‚¬Å¡Ã‚Â¬Ãƒâ€¦Ã‚Â¡ÃƒÆ’Ã†â€™ÃƒÂ¢Ã¢â€šÂ¬Ã…Â¡ÃƒÆ’Ã¢â‚¬Å¡Ãƒâ€šÃ‚Â¬ÃƒÆ’Ã†â€™Ãƒâ€ Ã¢â‚¬â„¢ÃƒÆ’Ã¢â‚¬Â ÃƒÂ¢Ã¢â€šÂ¬Ã¢â€žÂ¢ÃƒÆ’Ã†â€™Ãƒâ€šÃ‚Â¢ÃƒÆ’Ã‚Â¢ÃƒÂ¢Ã¢â€šÂ¬Ã…Â¡Ãƒâ€šÃ‚Â¬ÃƒÆ’Ã¢â‚¬Å¡Ãƒâ€šÃ‚Â¦ÃƒÆ’Ã†â€™Ãƒâ€ Ã¢â‚¬â„¢ÃƒÆ’Ã‚Â¢ÃƒÂ¢Ã¢â‚¬Å¡Ã‚Â¬Ãƒâ€¦Ã‚Â¡ÃƒÆ’Ã†â€™ÃƒÂ¢Ã¢â€šÂ¬Ã…Â¡ÃƒÆ’Ã¢â‚¬Å¡Ãƒâ€šÃ‚Â¡ÃƒÆ’Ã†â€™Ãƒâ€ Ã¢â‚¬â„¢ÃƒÆ’Ã¢â‚¬Â ÃƒÂ¢Ã¢â€šÂ¬Ã¢â€žÂ¢ÃƒÆ’Ã†â€™ÃƒÂ¢Ã¢â€šÂ¬Ã‚Â ÃƒÆ’Ã‚Â¢ÃƒÂ¢Ã¢â‚¬Å¡Ã‚Â¬ÃƒÂ¢Ã¢â‚¬Å¾Ã‚Â¢ÃƒÆ’Ã†â€™Ãƒâ€ Ã¢â‚¬â„¢ÃƒÆ’Ã‚Â¢ÃƒÂ¢Ã¢â‚¬Å¡Ã‚Â¬Ãƒâ€šÃ‚Â ÃƒÆ’Ã†â€™Ãƒâ€šÃ‚Â¢ÃƒÆ’Ã‚Â¢ÃƒÂ¢Ã¢â€šÂ¬Ã…Â¡Ãƒâ€šÃ‚Â¬ÃƒÆ’Ã‚Â¢ÃƒÂ¢Ã¢â€šÂ¬Ã…Â¾Ãƒâ€šÃ‚Â¢ÃƒÆ’Ã†â€™Ãƒâ€ Ã¢â‚¬â„¢ÃƒÆ’Ã¢â‚¬Â ÃƒÂ¢Ã¢â€šÂ¬Ã¢â€žÂ¢ÃƒÆ’Ã†â€™ÃƒÂ¢Ã¢â€šÂ¬Ã…Â¡ÃƒÆ’Ã¢â‚¬Å¡Ãƒâ€šÃ‚Â¢ÃƒÆ’Ã†â€™Ãƒâ€ Ã¢â‚¬â„¢ÃƒÆ’Ã¢â‚¬Å¡Ãƒâ€šÃ‚Â¢ÃƒÆ’Ã†â€™Ãƒâ€šÃ‚Â¢ÃƒÆ’Ã‚Â¢ÃƒÂ¢Ã¢â€šÂ¬Ã…Â¡Ãƒâ€šÃ‚Â¬ÃƒÆ’Ã¢â‚¬Â¦Ãƒâ€šÃ‚Â¡ÃƒÆ’Ã†â€™ÃƒÂ¢Ã¢â€šÂ¬Ã…Â¡ÃƒÆ’Ã¢â‚¬Å¡Ãƒâ€šÃ‚Â¬ÃƒÆ’Ã†â€™Ãƒâ€ Ã¢â‚¬â„¢ÃƒÆ’Ã‚Â¢ÃƒÂ¢Ã¢â‚¬Å¡Ã‚Â¬Ãƒâ€šÃ‚Â¦ÃƒÆ’Ã†â€™ÃƒÂ¢Ã¢â€šÂ¬Ã…Â¡ÃƒÆ’Ã¢â‚¬Å¡Ãƒâ€šÃ‚Â¡ÃƒÆ’Ã†â€™Ãƒâ€ Ã¢â‚¬â„¢ÃƒÆ’Ã¢â‚¬Â ÃƒÂ¢Ã¢â€šÂ¬Ã¢â€žÂ¢ÃƒÆ’Ã†â€™ÃƒÂ¢Ã¢â€šÂ¬Ã‚Â ÃƒÆ’Ã‚Â¢ÃƒÂ¢Ã¢â‚¬Å¡Ã‚Â¬ÃƒÂ¢Ã¢â‚¬Å¾Ã‚Â¢ÃƒÆ’Ã†â€™Ãƒâ€ Ã¢â‚¬â„¢ÃƒÆ’Ã¢â‚¬Å¡Ãƒâ€šÃ‚Â¢ÃƒÆ’Ã†â€™Ãƒâ€šÃ‚Â¢ÃƒÆ’Ã‚Â¢ÃƒÂ¢Ã¢â‚¬Å¡Ã‚Â¬Ãƒâ€¦Ã‚Â¡ÃƒÆ’Ã¢â‚¬Å¡Ãƒâ€šÃ‚Â¬ÃƒÆ’Ã†â€™ÃƒÂ¢Ã¢â€šÂ¬Ã‚Â¦ÃƒÆ’Ã¢â‚¬Å¡Ãƒâ€šÃ‚Â¡ÃƒÆ’Ã†â€™Ãƒâ€ Ã¢â‚¬â„¢ÃƒÆ’Ã¢â‚¬Â ÃƒÂ¢Ã¢â€šÂ¬Ã¢â€žÂ¢ÃƒÆ’Ã†â€™Ãƒâ€šÃ‚Â¢ÃƒÆ’Ã‚Â¢ÃƒÂ¢Ã¢â€šÂ¬Ã…Â¡Ãƒâ€šÃ‚Â¬ÃƒÆ’Ã¢â‚¬Â¦Ãƒâ€šÃ‚Â¡ÃƒÆ’Ã†â€™Ãƒâ€ Ã¢â‚¬â„¢ÃƒÆ’Ã‚Â¢ÃƒÂ¢Ã¢â‚¬Å¡Ã‚Â¬Ãƒâ€¦Ã‚Â¡ÃƒÆ’Ã†â€™ÃƒÂ¢Ã¢â€šÂ¬Ã…Â¡ÃƒÆ’Ã¢â‚¬Å¡Ãƒâ€šÃ‚Â¼g</w:t>
       </w:r>
       <w:proofErr w:type="spellEnd"/>
       <w:r>
@@ -8276,7 +8276,7 @@
           <w:sz w:val="28"/>
           <w:szCs w:val="28"/>
         </w:rPr>
-        <w:t>ÃƒÆ’Ã†â€™Ãƒâ€ Ã¢â‚¬â„¢ÃƒÆ’Ã¢â‚¬Â ÃƒÂ¢Ã¢â€šÂ¬Ã¢â€žÂ¢ÃƒÆ’Ã†â€™ÃƒÂ¢Ã¢â€šÂ¬Ã‚Â ÃƒÆ’Ã‚Â¢ÃƒÂ¢Ã¢â‚¬Å¡Ã‚Â¬ÃƒÂ¢Ã¢â‚¬Å¾Ã‚Â¢ÃƒÆ’Ã†â€™Ãƒâ€ Ã¢â‚¬â„¢ÃƒÆ’Ã‚Â¢ÃƒÂ¢Ã¢â‚¬Å¡Ã‚Â¬Ãƒâ€šÃ‚Â ÃƒÆ’Ã†â€™Ãƒâ€šÃ‚Â¢ÃƒÆ’Ã‚Â¢ÃƒÂ¢Ã¢â€šÂ¬Ã…Â¡Ãƒâ€šÃ‚Â¬ÃƒÆ’Ã‚Â¢ÃƒÂ¢Ã¢â€šÂ¬Ã…Â¾Ãƒâ€šÃ‚Â¢ÃƒÆ’Ã†â€™Ãƒâ€ Ã¢â‚¬â„¢ÃƒÆ’Ã¢â‚¬Â ÃƒÂ¢Ã¢â€šÂ¬Ã¢â€žÂ¢ÃƒÆ’Ã†â€™Ãƒâ€šÃ‚Â¢ÃƒÆ’Ã‚Â¢ÃƒÂ¢Ã¢â€šÂ¬Ã…Â¡Ãƒâ€šÃ‚Â¬ÃƒÆ’Ã¢â‚¬Å¡Ãƒâ€šÃ‚Â ÃƒÆ’Ã†â€™Ãƒâ€ Ã¢â‚¬â„¢ÃƒÆ’Ã¢â‚¬Å¡Ãƒâ€šÃ‚Â¢ÃƒÆ’Ã†â€™Ãƒâ€šÃ‚Â¢ÃƒÆ’Ã‚Â¢ÃƒÂ¢Ã¢â‚¬Å¡Ã‚Â¬Ãƒâ€¦Ã‚Â¡ÃƒÆ’Ã¢â‚¬Å¡Ãƒâ€šÃ‚Â¬ÃƒÆ’Ã†â€™Ãƒâ€šÃ‚Â¢ÃƒÆ’Ã‚Â¢ÃƒÂ¢Ã¢â‚¬Å¡Ã‚Â¬Ãƒâ€¦Ã‚Â¾ÃƒÆ’Ã¢â‚¬Å¡Ãƒâ€šÃ‚Â¢ÃƒÆ’Ã†â€™Ãƒâ€ Ã¢â‚¬â„¢ÃƒÆ’Ã¢â‚¬Â ÃƒÂ¢Ã¢â€šÂ¬Ã¢â€žÂ¢ÃƒÆ’Ã†â€™ÃƒÂ¢Ã¢â€šÂ¬Ã‚Â ÃƒÆ’Ã‚Â¢ÃƒÂ¢Ã¢â‚¬Å¡Ã‚Â¬ÃƒÂ¢Ã¢â‚¬Å¾Ã‚Â¢ÃƒÆ’Ã†â€™Ãƒâ€ Ã¢â‚¬â„¢ÃƒÆ’Ã¢â‚¬Å¡Ãƒâ€šÃ‚Â¢ÃƒÆ’Ã†â€™Ãƒâ€šÃ‚Â¢ÃƒÆ’Ã‚Â¢ÃƒÂ¢Ã¢â‚¬Å¡Ã‚Â¬Ãƒâ€¦Ã‚Â¡ÃƒÆ’Ã¢â‚¬Å¡Ãƒâ€šÃ‚Â¬ÃƒÆ’Ã†â€™ÃƒÂ¢Ã¢â€šÂ¬Ã…Â¡ÃƒÆ’Ã¢â‚¬Å¡Ãƒâ€šÃ‚Â¦ÃƒÆ’Ã†â€™Ãƒâ€ Ã¢â‚¬â„¢ÃƒÆ’Ã¢â‚¬Â ÃƒÂ¢Ã¢â€šÂ¬Ã¢â€žÂ¢ÃƒÆ’Ã†â€™Ãƒâ€šÃ‚Â¢ÃƒÆ’Ã‚Â¢ÃƒÂ¢Ã¢â€šÂ¬Ã…Â¡Ãƒâ€šÃ‚Â¬ÃƒÆ’Ã¢â‚¬Â¦Ãƒâ€šÃ‚Â¡ÃƒÆ’Ã†â€™Ãƒâ€ Ã¢â‚¬â„¢ÃƒÆ’Ã‚Â¢ÃƒÂ¢Ã¢â‚¬Å¡Ã‚Â¬Ãƒâ€¦Ã‚Â¡ÃƒÆ’Ã†â€™ÃƒÂ¢Ã¢â€šÂ¬Ã…Â¡ÃƒÆ’Ã¢â‚¬Å¡Ãƒâ€šÃ‚Â½ÃƒÆ’Ã†â€™Ãƒâ€ Ã¢â‚¬â„¢ÃƒÆ’Ã¢â‚¬Â ÃƒÂ¢Ã¢â€šÂ¬Ã¢â€žÂ¢ÃƒÆ’Ã†â€™ÃƒÂ¢Ã¢â€šÂ¬Ã‚Â ÃƒÆ’Ã‚Â¢ÃƒÂ¢Ã¢â‚¬Å¡Ã‚Â¬ÃƒÂ¢Ã¢â‚¬Å¾Ã‚Â¢ÃƒÆ’Ã†â€™Ãƒâ€ Ã¢â‚¬â„¢ÃƒÆ’Ã‚Â¢ÃƒÂ¢Ã¢â‚¬Å¡Ã‚Â¬Ãƒâ€šÃ‚Â ÃƒÆ’Ã†â€™Ãƒâ€šÃ‚Â¢ÃƒÆ’Ã‚Â¢ÃƒÂ¢Ã¢â€šÂ¬Ã…Â¡Ãƒâ€šÃ‚Â¬ÃƒÆ’Ã‚Â¢ÃƒÂ¢Ã¢â€šÂ¬Ã…Â¾Ãƒâ€šÃ‚Â¢ÃƒÆ’Ã†â€™Ãƒâ€ Ã¢â‚¬â„¢ÃƒÆ’Ã¢â‚¬Â ÃƒÂ¢Ã¢â€šÂ¬Ã¢â€žÂ¢ÃƒÆ’Ã†â€™ÃƒÂ¢Ã¢â€šÂ¬Ã…Â¡ÃƒÆ’Ã¢â‚¬Å¡Ãƒâ€šÃ‚Â¢ÃƒÆ’Ã†â€™Ãƒâ€ Ã¢â‚¬â„¢ÃƒÆ’Ã¢â‚¬Å¡Ãƒâ€šÃ‚Â¢ÃƒÆ’Ã†â€™Ãƒâ€šÃ‚Â¢ÃƒÆ’Ã‚Â¢ÃƒÂ¢Ã¢â€šÂ¬Ã…Â¡Ãƒâ€šÃ‚Â¬ÃƒÆ’Ã¢â‚¬Â¦Ãƒâ€šÃ‚Â¡ÃƒÆ’Ã†â€™ÃƒÂ¢Ã¢â€šÂ¬Ã…Â¡ÃƒÆ’Ã¢â‚¬Å¡Ãƒâ€šÃ‚Â¬ÃƒÆ’Ã†â€™Ãƒâ€ Ã¢â‚¬â„¢ÃƒÆ’Ã‚Â¢ÃƒÂ¢Ã¢â‚¬Å¡Ã‚Â¬Ãƒâ€šÃ‚Â¦ÃƒÆ’Ã†â€™ÃƒÂ¢Ã¢â€šÂ¬Ã…Â¡ÃƒÆ’Ã¢â‚¬Å¡Ãƒâ€šÃ‚Â¡ÃƒÆ’Ã†â€™Ãƒâ€ Ã¢â‚¬â„¢ÃƒÆ’Ã¢â‚¬Â ÃƒÂ¢Ã¢â€šÂ¬Ã¢â€žÂ¢ÃƒÆ’Ã†â€™ÃƒÂ¢Ã¢â€šÂ¬Ã‚Â ÃƒÆ’Ã‚Â¢ÃƒÂ¢Ã¢â‚¬Å¡Ã‚Â¬ÃƒÂ¢Ã¢â‚¬Å¾Ã‚Â¢ÃƒÆ’Ã†â€™Ãƒâ€ Ã¢â‚¬â„¢ÃƒÆ’Ã¢â‚¬Å¡Ãƒâ€šÃ‚Â¢ÃƒÆ’Ã†â€™Ãƒâ€šÃ‚Â¢ÃƒÆ’Ã‚Â¢ÃƒÂ¢Ã¢â‚¬Å¡Ã‚Â¬Ãƒâ€¦Ã‚Â¡ÃƒÆ’Ã¢â‚¬Å¡Ãƒâ€šÃ‚Â¬ÃƒÆ’Ã†â€™ÃƒÂ¢Ã¢â€šÂ¬Ã‚Â¦ÃƒÆ’Ã¢â‚¬Å¡Ãƒâ€šÃ‚Â¡ÃƒÆ’Ã†â€™Ãƒâ€ Ã¢â‚¬â„¢ÃƒÆ’Ã¢â‚¬Â ÃƒÂ¢Ã¢â€šÂ¬Ã¢â€žÂ¢ÃƒÆ’Ã†â€™Ãƒâ€šÃ‚Â¢ÃƒÆ’Ã‚Â¢ÃƒÂ¢Ã¢â€šÂ¬Ã…Â¡Ãƒâ€šÃ‚Â¬ÃƒÆ’Ã¢â‚¬Â¦Ãƒâ€šÃ‚Â¡ÃƒÆ’Ã†â€™Ãƒâ€ Ã¢â‚¬â„¢ÃƒÆ’Ã‚Â¢ÃƒÂ¢Ã¢â‚¬Å¡Ã‚Â¬Ãƒâ€¦Ã‚Â¡ÃƒÆ’Ã†â€™ÃƒÂ¢Ã¢â€šÂ¬Ã…Â¡ÃƒÆ’Ã¢â‚¬Å¡Ãƒâ€šÃ‚Â¼g</w:t>
+        <w:t>ÃƒÆ’Ã†â€™Ãƒâ€ Ã¢â‚¬â„¢ÃƒÆ’Ã¢â‚¬Â ÃƒÂ¢Ã¢â€šÂ¬Ã¢â€žÂ¢ÃƒÆ’Ã†â€™ÃƒÂ¢Ã¢â€šÂ¬Ã‚Â ÃƒÆ’Ã‚Â¢ÃƒÂ¢Ã¢â‚¬Å¡Ã‚Â¬ÃƒÂ¢Ã¢â‚¬Å¾Ã‚Â¢ÃƒÆ’Ã†â€™Ãƒâ€ Ã¢â‚¬â„¢ÃƒÆ’Ã‚Â¢ÃƒÂ¢Ã¢â‚¬Å¡Ã‚Â¬Ãƒâ€šÃ‚Â ÃƒÆ’Ã†â€™Ãƒâ€šÃ‚Â¢ÃƒÆ’Ã‚Â¢ÃƒÂ¢Ã¢â€šÂ¬Ã…Â¡Ãƒâ€šÃ‚Â¬ÃƒÆ’Ã‚Â¢ÃƒÂ¢Ã¢â€šÂ¬Ã…Â¾Ãƒâ€šÃ‚Â¢ÃƒÆ’Ã†â€™Ãƒâ€ Ã¢â‚¬â„¢ÃƒÆ’Ã¢â‚¬Â ÃƒÂ¢Ã¢â€šÂ¬Ã¢â€žÂ¢ÃƒÆ’Ã†â€™Ãƒâ€šÃ‚Â¢ÃƒÆ’Ã‚Â¢ÃƒÂ¢Ã¢â€šÂ¬Ã…Â¡Ãƒâ€šÃ‚Â¬ÃƒÆ’Ã¢â‚¬Å¡Ãƒâ€šÃ‚Â ÃƒÆ’Ã†â€™Ãƒâ€ Ã¢â‚¬â„¢ÃƒÆ’Ã¢â‚¬Å¡Ãƒâ€šÃ‚Â¢ÃƒÆ’Ã†â€™Ãƒâ€šÃ‚Â¢ÃƒÆ’Ã‚Â¢ÃƒÂ¢Ã¢â‚¬Å¡Ã‚Â¬Ãƒâ€¦Ã‚Â¡ÃƒÆ’Ã¢â‚¬Å¡Ãƒâ€šÃ‚Â¬ÃƒÆ’Ã†â€™Ãƒâ€šÃ‚Â¢ÃƒÆ’Ã‚Â¢ÃƒÂ¢Ã¢â‚¬Å¡Ã‚Â¬Ãƒâ€¦Ã‚Â¾ÃƒÆ’Ã¢â‚¬Å¡Ãƒâ€šÃ‚Â¢ÃƒÆ’Ã†â€™Ãƒâ€ Ã¢â‚¬â„¢ÃƒÆ’Ã¢â‚¬Â ÃƒÂ¢Ã¢â€šÂ¬Ã¢â€žÂ¢ÃƒÆ’Ã†â€™ÃƒÂ¢Ã¢â€šÂ¬Ã‚Â ÃƒÆ’Ã‚Â¢ÃƒÂ¢Ã¢â‚¬Å¡Ã‚Â¬ÃƒÂ¢Ã¢â‚¬Å¾Ã‚Â¢ÃƒÆ’Ã†â€™Ãƒâ€ Ã¢â‚¬â„¢ÃƒÆ’Ã¢â‚¬Å¡Ãƒâ€šÃ‚Â¢ÃƒÆ’Ã†â€™Ãƒâ€šÃ‚Â¢ÃƒÆ’Ã‚Â¢ÃƒÂ¢Ã¢â‚¬Å¡Ã‚Â¬Ãƒâ€¦Ã‚Â¡ÃƒÆ’Ã¢â‚¬Å¡Ãƒâ€šÃ‚Â¬ÃƒÆ’Ã†â€™ÃƒÂ¢Ã¢â€šÂ¬Ã…Â¡ÃƒÆ’Ã¢â‚¬Å¡Ãƒâ€šÃ‚Â ÃƒÆ’Ã†â€™Ãƒâ€ Ã¢â‚¬â„¢ÃƒÆ’Ã¢â‚¬Â ÃƒÂ¢Ã¢â€šÂ¬Ã¢â€žÂ¢ÃƒÆ’Ã†â€™ÃƒÂ¢Ã¢â€šÂ¬Ã…Â¡ÃƒÆ’Ã¢â‚¬Å¡Ãƒâ€šÃ‚Â¢ÃƒÆ’Ã†â€™Ãƒâ€ Ã¢â‚¬â„¢ÃƒÆ’Ã¢â‚¬Å¡Ãƒâ€šÃ‚Â¢ÃƒÆ’Ã†â€™Ãƒâ€šÃ‚Â¢ÃƒÆ’Ã‚Â¢ÃƒÂ¢Ã¢â€šÂ¬Ã…Â¡Ãƒâ€šÃ‚Â¬ÃƒÆ’Ã¢â‚¬Â¦Ãƒâ€šÃ‚Â¡ÃƒÆ’Ã†â€™ÃƒÂ¢Ã¢â€šÂ¬Ã…Â¡ÃƒÆ’Ã¢â‚¬Å¡Ãƒâ€šÃ‚Â¬ÃƒÆ’Ã†â€™Ãƒâ€ Ã¢â‚¬â„¢ÃƒÆ’Ã¢â‚¬Å¡Ãƒâ€šÃ‚Â¢ÃƒÆ’Ã†â€™Ãƒâ€šÃ‚Â¢ÃƒÆ’Ã‚Â¢ÃƒÂ¢Ã¢â€šÂ¬Ã…Â¡Ãƒâ€šÃ‚Â¬ÃƒÆ’Ã¢â‚¬Â¦Ãƒâ€šÃ‚Â¾ÃƒÆ’Ã†â€™ÃƒÂ¢Ã¢â€šÂ¬Ã…Â¡ÃƒÆ’Ã¢â‚¬Å¡Ãƒâ€šÃ‚Â¢ÃƒÆ’Ã†â€™Ãƒâ€ Ã¢â‚¬â„¢ÃƒÆ’Ã¢â‚¬Â ÃƒÂ¢Ã¢â€šÂ¬Ã¢â€žÂ¢ÃƒÆ’Ã†â€™ÃƒÂ¢Ã¢â€šÂ¬Ã‚Â ÃƒÆ’Ã‚Â¢ÃƒÂ¢Ã¢â‚¬Å¡Ã‚Â¬ÃƒÂ¢Ã¢â‚¬Å¾Ã‚Â¢ÃƒÆ’Ã†â€™Ãƒâ€ Ã¢â‚¬â„¢ÃƒÆ’Ã‚Â¢ÃƒÂ¢Ã¢â‚¬Å¡Ã‚Â¬Ãƒâ€šÃ‚Â ÃƒÆ’Ã†â€™Ãƒâ€šÃ‚Â¢ÃƒÆ’Ã‚Â¢ÃƒÂ¢Ã¢â€šÂ¬Ã…Â¡Ãƒâ€šÃ‚Â¬ÃƒÆ’Ã‚Â¢ÃƒÂ¢Ã¢â€šÂ¬Ã…Â¾Ãƒâ€šÃ‚Â¢ÃƒÆ’Ã†â€™Ãƒâ€ Ã¢â‚¬â„¢ÃƒÆ’Ã¢â‚¬Â ÃƒÂ¢Ã¢â€šÂ¬Ã¢â€žÂ¢ÃƒÆ’Ã†â€™ÃƒÂ¢Ã¢â€šÂ¬Ã…Â¡ÃƒÆ’Ã¢â‚¬Å¡Ãƒâ€šÃ‚Â¢ÃƒÆ’Ã†â€™Ãƒâ€ Ã¢â‚¬â„¢ÃƒÆ’Ã¢â‚¬Å¡Ãƒâ€šÃ‚Â¢ÃƒÆ’Ã†â€™Ãƒâ€šÃ‚Â¢ÃƒÆ’Ã‚Â¢ÃƒÂ¢Ã¢â€šÂ¬Ã…Â¡Ãƒâ€šÃ‚Â¬ÃƒÆ’Ã¢â‚¬Â¦Ãƒâ€šÃ‚Â¡ÃƒÆ’Ã†â€™ÃƒÂ¢Ã¢â€šÂ¬Ã…Â¡ÃƒÆ’Ã¢â‚¬Å¡Ãƒâ€šÃ‚Â¬ÃƒÆ’Ã†â€™Ãƒâ€ Ã¢â‚¬â„¢ÃƒÆ’Ã‚Â¢ÃƒÂ¢Ã¢â‚¬Å¡Ã‚Â¬Ãƒâ€¦Ã‚Â¡ÃƒÆ’Ã†â€™ÃƒÂ¢Ã¢â€šÂ¬Ã…Â¡ÃƒÆ’Ã¢â‚¬Å¡Ãƒâ€šÃ‚Â¦ÃƒÆ’Ã†â€™Ãƒâ€ Ã¢â‚¬â„¢ÃƒÆ’Ã¢â‚¬Â ÃƒÂ¢Ã¢â€šÂ¬Ã¢â€žÂ¢ÃƒÆ’Ã†â€™ÃƒÂ¢Ã¢â€šÂ¬Ã‚Â ÃƒÆ’Ã‚Â¢ÃƒÂ¢Ã¢â‚¬Å¡Ã‚Â¬ÃƒÂ¢Ã¢â‚¬Å¾Ã‚Â¢ÃƒÆ’Ã†â€™Ãƒâ€ Ã¢â‚¬â„¢ÃƒÆ’Ã¢â‚¬Å¡Ãƒâ€šÃ‚Â¢ÃƒÆ’Ã†â€™Ãƒâ€šÃ‚Â¢ÃƒÆ’Ã‚Â¢ÃƒÂ¢Ã¢â‚¬Å¡Ã‚Â¬Ãƒâ€¦Ã‚Â¡ÃƒÆ’Ã¢â‚¬Å¡Ãƒâ€šÃ‚Â¬ÃƒÆ’Ã†â€™ÃƒÂ¢Ã¢â€šÂ¬Ã‚Â¦ÃƒÆ’Ã¢â‚¬Å¡Ãƒâ€šÃ‚Â¡ÃƒÆ’Ã†â€™Ãƒâ€ Ã¢â‚¬â„¢ÃƒÆ’Ã¢â‚¬Â ÃƒÂ¢Ã¢â€šÂ¬Ã¢â€žÂ¢ÃƒÆ’Ã†â€™Ãƒâ€šÃ‚Â¢ÃƒÆ’Ã‚Â¢ÃƒÂ¢Ã¢â€šÂ¬Ã…Â¡Ãƒâ€šÃ‚Â¬ÃƒÆ’Ã¢â‚¬Â¦Ãƒâ€šÃ‚Â¡ÃƒÆ’Ã†â€™Ãƒâ€ Ã¢â‚¬â„¢ÃƒÆ’Ã‚Â¢ÃƒÂ¢Ã¢â‚¬Å¡Ã‚Â¬Ãƒâ€¦Ã‚Â¡ÃƒÆ’Ã†â€™ÃƒÂ¢Ã¢â€šÂ¬Ã…Â¡ÃƒÆ’Ã¢â‚¬Å¡Ãƒâ€šÃ‚Â½ÃƒÆ’Ã†â€™Ãƒâ€ Ã¢â‚¬â„¢ÃƒÆ’Ã¢â‚¬Â ÃƒÂ¢Ã¢â€šÂ¬Ã¢â€žÂ¢ÃƒÆ’Ã†â€™ÃƒÂ¢Ã¢â€šÂ¬Ã‚Â ÃƒÆ’Ã‚Â¢ÃƒÂ¢Ã¢â‚¬Å¡Ã‚Â¬ÃƒÂ¢Ã¢â‚¬Å¾Ã‚Â¢ÃƒÆ’Ã†â€™Ãƒâ€ Ã¢â‚¬â„¢ÃƒÆ’Ã‚Â¢ÃƒÂ¢Ã¢â‚¬Å¡Ã‚Â¬Ãƒâ€šÃ‚Â ÃƒÆ’Ã†â€™Ãƒâ€šÃ‚Â¢ÃƒÆ’Ã‚Â¢ÃƒÂ¢Ã¢â€šÂ¬Ã…Â¡Ãƒâ€šÃ‚Â¬ÃƒÆ’Ã‚Â¢ÃƒÂ¢Ã¢â€šÂ¬Ã…Â¾Ãƒâ€šÃ‚Â¢ÃƒÆ’Ã†â€™Ãƒâ€ Ã¢â‚¬â„¢ÃƒÆ’Ã¢â‚¬Â ÃƒÂ¢Ã¢â€šÂ¬Ã¢â€žÂ¢ÃƒÆ’Ã†â€™Ãƒâ€šÃ‚Â¢ÃƒÆ’Ã‚Â¢ÃƒÂ¢Ã¢â€šÂ¬Ã…Â¡Ãƒâ€šÃ‚Â¬ÃƒÆ’Ã¢â‚¬Å¡Ãƒâ€šÃ‚Â ÃƒÆ’Ã†â€™Ãƒâ€ Ã¢â‚¬â„¢ÃƒÆ’Ã¢â‚¬Å¡Ãƒâ€šÃ‚Â¢ÃƒÆ’Ã†â€™Ãƒâ€šÃ‚Â¢ÃƒÆ’Ã‚Â¢ÃƒÂ¢Ã¢â‚¬Å¡Ã‚Â¬Ãƒâ€¦Ã‚Â¡ÃƒÆ’Ã¢â‚¬Å¡Ãƒâ€šÃ‚Â¬ÃƒÆ’Ã†â€™Ãƒâ€šÃ‚Â¢ÃƒÆ’Ã‚Â¢ÃƒÂ¢Ã¢â‚¬Å¡Ã‚Â¬Ãƒâ€¦Ã‚Â¾ÃƒÆ’Ã¢â‚¬Å¡Ãƒâ€šÃ‚Â¢ÃƒÆ’Ã†â€™Ãƒâ€ Ã¢â‚¬â„¢ÃƒÆ’Ã¢â‚¬Â ÃƒÂ¢Ã¢â€šÂ¬Ã¢â€žÂ¢ÃƒÆ’Ã†â€™ÃƒÂ¢Ã¢â€šÂ¬Ã‚Â ÃƒÆ’Ã‚Â¢ÃƒÂ¢Ã¢â‚¬Å¡Ã‚Â¬ÃƒÂ¢Ã¢â‚¬Å¾Ã‚Â¢ÃƒÆ’Ã†â€™Ãƒâ€ Ã¢â‚¬â„¢ÃƒÆ’Ã‚Â¢ÃƒÂ¢Ã¢â‚¬Å¡Ã‚Â¬Ãƒâ€¦Ã‚Â¡ÃƒÆ’Ã†â€™ÃƒÂ¢Ã¢â€šÂ¬Ã…Â¡ÃƒÆ’Ã¢â‚¬Å¡Ãƒâ€šÃ‚Â¢ÃƒÆ’Ã†â€™Ãƒâ€ Ã¢â‚¬â„¢ÃƒÆ’Ã¢â‚¬Â ÃƒÂ¢Ã¢â€šÂ¬Ã¢â€žÂ¢ÃƒÆ’Ã†â€™ÃƒÂ¢Ã¢â€šÂ¬Ã…Â¡ÃƒÆ’Ã¢â‚¬Å¡Ãƒâ€šÃ‚Â¢ÃƒÆ’Ã†â€™Ãƒâ€ Ã¢â‚¬â„¢ÃƒÆ’Ã¢â‚¬Å¡Ãƒâ€šÃ‚Â¢ÃƒÆ’Ã†â€™Ãƒâ€šÃ‚Â¢ÃƒÆ’Ã‚Â¢ÃƒÂ¢Ã¢â‚¬Å¡Ã‚Â¬Ãƒâ€¦Ã‚Â¡ÃƒÆ’Ã¢â‚¬Å¡Ãƒâ€šÃ‚Â¬ÃƒÆ’Ã†â€™ÃƒÂ¢Ã¢â€šÂ¬Ã‚Â¦ÃƒÆ’Ã¢â‚¬Å¡Ãƒâ€šÃ‚Â¡ÃƒÆ’Ã†â€™Ãƒâ€ Ã¢â‚¬â„¢ÃƒÆ’Ã‚Â¢ÃƒÂ¢Ã¢â‚¬Å¡Ã‚Â¬Ãƒâ€¦Ã‚Â¡ÃƒÆ’Ã†â€™ÃƒÂ¢Ã¢â€šÂ¬Ã…Â¡ÃƒÆ’Ã¢â‚¬Å¡Ãƒâ€šÃ‚Â¬ÃƒÆ’Ã†â€™Ãƒâ€ Ã¢â‚¬â„¢ÃƒÆ’Ã¢â‚¬Â ÃƒÂ¢Ã¢â€šÂ¬Ã¢â€žÂ¢ÃƒÆ’Ã†â€™Ãƒâ€šÃ‚Â¢ÃƒÆ’Ã‚Â¢ÃƒÂ¢Ã¢â€šÂ¬Ã…Â¡Ãƒâ€šÃ‚Â¬ÃƒÆ’Ã¢â‚¬Å¡Ãƒâ€šÃ‚Â¦ÃƒÆ’Ã†â€™Ãƒâ€ Ã¢â‚¬â„¢ÃƒÆ’Ã‚Â¢ÃƒÂ¢Ã¢â‚¬Å¡Ã‚Â¬Ãƒâ€¦Ã‚Â¡ÃƒÆ’Ã†â€™ÃƒÂ¢Ã¢â€šÂ¬Ã…Â¡ÃƒÆ’Ã¢â‚¬Å¡Ãƒâ€šÃ‚Â¡ÃƒÆ’Ã†â€™Ãƒâ€ Ã¢â‚¬â„¢ÃƒÆ’Ã¢â‚¬Â ÃƒÂ¢Ã¢â€šÂ¬Ã¢â€žÂ¢ÃƒÆ’Ã†â€™ÃƒÂ¢Ã¢â€šÂ¬Ã‚Â ÃƒÆ’Ã‚Â¢ÃƒÂ¢Ã¢â‚¬Å¡Ã‚Â¬ÃƒÂ¢Ã¢â‚¬Å¾Ã‚Â¢ÃƒÆ’Ã†â€™Ãƒâ€ Ã¢â‚¬â„¢ÃƒÆ’Ã‚Â¢ÃƒÂ¢Ã¢â‚¬Å¡Ã‚Â¬Ãƒâ€šÃ‚Â ÃƒÆ’Ã†â€™Ãƒâ€šÃ‚Â¢ÃƒÆ’Ã‚Â¢ÃƒÂ¢Ã¢â€šÂ¬Ã…Â¡Ãƒâ€šÃ‚Â¬ÃƒÆ’Ã‚Â¢ÃƒÂ¢Ã¢â€šÂ¬Ã…Â¾Ãƒâ€šÃ‚Â¢ÃƒÆ’Ã†â€™Ãƒâ€ Ã¢â‚¬â„¢ÃƒÆ’Ã¢â‚¬Â ÃƒÂ¢Ã¢â€šÂ¬Ã¢â€žÂ¢ÃƒÆ’Ã†â€™ÃƒÂ¢Ã¢â€šÂ¬Ã…Â¡ÃƒÆ’Ã¢â‚¬Å¡Ãƒâ€šÃ‚Â¢ÃƒÆ’Ã†â€™Ãƒâ€ Ã¢â‚¬â„¢ÃƒÆ’Ã¢â‚¬Å¡Ãƒâ€šÃ‚Â¢ÃƒÆ’Ã†â€™Ãƒâ€šÃ‚Â¢ÃƒÆ’Ã‚Â¢ÃƒÂ¢Ã¢â€šÂ¬Ã…Â¡Ãƒâ€šÃ‚Â¬ÃƒÆ’Ã¢â‚¬Â¦Ãƒâ€šÃ‚Â¡ÃƒÆ’Ã†â€™ÃƒÂ¢Ã¢â€šÂ¬Ã…Â¡ÃƒÆ’Ã¢â‚¬Å¡Ãƒâ€šÃ‚Â¬ÃƒÆ’Ã†â€™Ãƒâ€ Ã¢â‚¬â„¢ÃƒÆ’Ã‚Â¢ÃƒÂ¢Ã¢â‚¬Å¡Ã‚Â¬Ãƒâ€šÃ‚Â¦ÃƒÆ’Ã†â€™ÃƒÂ¢Ã¢â€šÂ¬Ã…Â¡ÃƒÆ’Ã¢â‚¬Å¡Ãƒâ€šÃ‚Â¡ÃƒÆ’Ã†â€™Ãƒâ€ Ã¢â‚¬â„¢ÃƒÆ’Ã¢â‚¬Â ÃƒÂ¢Ã¢â€šÂ¬Ã¢â€žÂ¢ÃƒÆ’Ã†â€™ÃƒÂ¢Ã¢â€šÂ¬Ã‚Â ÃƒÆ’Ã‚Â¢ÃƒÂ¢Ã¢â‚¬Å¡Ã‚Â¬ÃƒÂ¢Ã¢â‚¬Å¾Ã‚Â¢ÃƒÆ’Ã†â€™Ãƒâ€ Ã¢â‚¬â„¢ÃƒÆ’Ã¢â‚¬Å¡Ãƒâ€šÃ‚Â¢ÃƒÆ’Ã†â€™Ãƒâ€šÃ‚Â¢ÃƒÆ’Ã‚Â¢ÃƒÂ¢Ã¢â‚¬Å¡Ã‚Â¬Ãƒâ€¦Ã‚Â¡ÃƒÆ’Ã¢â‚¬Å¡Ãƒâ€šÃ‚Â¬ÃƒÆ’Ã†â€™ÃƒÂ¢Ã¢â€šÂ¬Ã‚Â¦ÃƒÆ’Ã¢â‚¬Å¡Ãƒâ€šÃ‚Â¡ÃƒÆ’Ã†â€™Ãƒâ€ Ã¢â‚¬â„¢ÃƒÆ’Ã¢â‚¬Â ÃƒÂ¢Ã¢â€šÂ¬Ã¢â€žÂ¢ÃƒÆ’Ã†â€™Ãƒâ€šÃ‚Â¢ÃƒÆ’Ã‚Â¢ÃƒÂ¢Ã¢â€šÂ¬Ã…Â¡Ãƒâ€šÃ‚Â¬ÃƒÆ’Ã¢â‚¬Â¦Ãƒâ€šÃ‚Â¡ÃƒÆ’Ã†â€™Ãƒâ€ Ã¢â‚¬â„¢ÃƒÆ’Ã‚Â¢ÃƒÂ¢Ã¢â‚¬Å¡Ã‚Â¬Ãƒâ€¦Ã‚Â¡ÃƒÆ’Ã†â€™ÃƒÂ¢Ã¢â€šÂ¬Ã…Â¡ÃƒÆ’Ã¢â‚¬Å¡Ãƒâ€šÃ‚Â¼g</w:t>
       </w:r>
       <w:proofErr w:type="spellEnd"/>
       <w:r>
@@ -8406,7 +8406,7 @@
           <w:szCs w:val="28"/>
         </w:rPr>
         <w:lastRenderedPageBreak/>
-        <w:t xml:space="preserve">By Week 7, sodium nitrite concentrations in both treatments had declined and stabilized at very similar levels, approximately 73ÃƒÆ’Ã†â€™Ãƒâ€ Ã¢â‚¬â„¢ÃƒÆ’Ã¢â‚¬Â ÃƒÂ¢Ã¢â€šÂ¬Ã¢â€žÂ¢ÃƒÆ’Ã†â€™ÃƒÂ¢Ã¢â€šÂ¬Ã‚Â ÃƒÆ’Ã‚Â¢ÃƒÂ¢Ã¢â‚¬Å¡Ã‚Â¬ÃƒÂ¢Ã¢â‚¬Å¾Ã‚Â¢ÃƒÆ’Ã†â€™Ãƒâ€ Ã¢â‚¬â„¢ÃƒÆ’Ã‚Â¢ÃƒÂ¢Ã¢â‚¬Å¡Ã‚Â¬Ãƒâ€šÃ‚Â ÃƒÆ’Ã†â€™Ãƒâ€šÃ‚Â¢ÃƒÆ’Ã‚Â¢ÃƒÂ¢Ã¢â€šÂ¬Ã…Â¡Ãƒâ€šÃ‚Â¬ÃƒÆ’Ã‚Â¢ÃƒÂ¢Ã¢â€šÂ¬Ã…Â¾Ãƒâ€šÃ‚Â¢ÃƒÆ’Ã†â€™Ãƒâ€ Ã¢â‚¬â„¢ÃƒÆ’Ã¢â‚¬Â ÃƒÂ¢Ã¢â€šÂ¬Ã¢â€žÂ¢ÃƒÆ’Ã†â€™Ãƒâ€šÃ‚Â¢ÃƒÆ’Ã‚Â¢ÃƒÂ¢Ã¢â€šÂ¬Ã…Â¡Ãƒâ€šÃ‚Â¬ÃƒÆ’Ã¢â‚¬Å¡Ãƒâ€šÃ‚Â ÃƒÆ’Ã†â€™Ãƒâ€ Ã¢â‚¬â„¢ÃƒÆ’Ã¢â‚¬Å¡Ãƒâ€šÃ‚Â¢ÃƒÆ’Ã†â€™Ãƒâ€šÃ‚Â¢ÃƒÆ’Ã‚Â¢ÃƒÂ¢Ã¢â‚¬Å¡Ã‚Â¬Ãƒâ€¦Ã‚Â¡ÃƒÆ’Ã¢â‚¬Å¡Ãƒâ€šÃ‚Â¬ÃƒÆ’Ã†â€™Ãƒâ€šÃ‚Â¢ÃƒÆ’Ã‚Â¢ÃƒÂ¢Ã¢â‚¬Å¡Ã‚Â¬Ãƒâ€¦Ã‚Â¾ÃƒÆ’Ã¢â‚¬Å¡Ãƒâ€šÃ‚Â¢ÃƒÆ’Ã†â€™Ãƒâ€ Ã¢â‚¬â„¢ÃƒÆ’Ã¢â‚¬Â ÃƒÂ¢Ã¢â€šÂ¬Ã¢â€žÂ¢ÃƒÆ’Ã†â€™ÃƒÂ¢Ã¢â€šÂ¬Ã‚Â ÃƒÆ’Ã‚Â¢ÃƒÂ¢Ã¢â‚¬Å¡Ã‚Â¬ÃƒÂ¢Ã¢â‚¬Å¾Ã‚Â¢ÃƒÆ’Ã†â€™Ãƒâ€ Ã¢â‚¬â„¢ÃƒÆ’Ã¢â‚¬Å¡Ãƒâ€šÃ‚Â¢ÃƒÆ’Ã†â€™Ãƒâ€šÃ‚Â¢ÃƒÆ’Ã‚Â¢ÃƒÂ¢Ã¢â‚¬Å¡Ã‚Â¬Ãƒâ€¦Ã‚Â¡ÃƒÆ’Ã¢â‚¬Å¡Ãƒâ€šÃ‚Â¬ÃƒÆ’Ã†â€™ÃƒÂ¢Ã¢â€šÂ¬Ã‚Â¦ÃƒÆ’Ã¢â‚¬Å¡Ãƒâ€šÃ‚Â¡ÃƒÆ’Ã†â€™Ãƒâ€ Ã¢â‚¬â„¢ÃƒÆ’Ã¢â‚¬Â ÃƒÂ¢Ã¢â€šÂ¬Ã¢â€žÂ¢ÃƒÆ’Ã†â€™Ãƒâ€šÃ‚Â¢ÃƒÆ’Ã‚Â¢ÃƒÂ¢Ã¢â€šÂ¬Ã…Â¡Ãƒâ€šÃ‚Â¬ÃƒÆ’Ã¢â‚¬Â¦Ãƒâ€šÃ‚Â¡ÃƒÆ’Ã†â€™Ãƒâ€ Ã¢â‚¬â„¢ÃƒÆ’Ã‚Â¢ÃƒÂ¢Ã¢â‚¬Å¡Ã‚Â¬Ãƒâ€¦Ã‚Â¡ÃƒÆ’Ã†â€™ÃƒÂ¢Ã¢â€šÂ¬Ã…Â¡ÃƒÆ’Ã¢â‚¬Å¡Ãƒâ€šÃ‚Â¢ÃƒÆ’Ã†â€™Ãƒâ€ Ã¢â‚¬â„¢ÃƒÆ’Ã¢â‚¬Â ÃƒÂ¢Ã¢â€šÂ¬Ã¢â€žÂ¢ÃƒÆ’Ã†â€™ÃƒÂ¢Ã¢â€šÂ¬Ã‚Â ÃƒÆ’Ã‚Â¢ÃƒÂ¢Ã¢â‚¬Å¡Ã‚Â¬ÃƒÂ¢Ã¢â‚¬Å¾Ã‚Â¢ÃƒÆ’Ã†â€™Ãƒâ€ Ã¢â‚¬â„¢ÃƒÆ’Ã‚Â¢ÃƒÂ¢Ã¢â‚¬Å¡Ã‚Â¬Ãƒâ€šÃ‚Â ÃƒÆ’Ã†â€™Ãƒâ€šÃ‚Â¢ÃƒÆ’Ã‚Â¢ÃƒÂ¢Ã¢â€šÂ¬Ã…Â¡Ãƒâ€šÃ‚Â¬ÃƒÆ’Ã‚Â¢ÃƒÂ¢Ã¢â€šÂ¬Ã…Â¾Ãƒâ€šÃ‚Â¢ÃƒÆ’Ã†â€™Ãƒâ€ Ã¢â‚¬â„¢ÃƒÆ’Ã¢â‚¬Â ÃƒÂ¢Ã¢â€šÂ¬Ã¢â€žÂ¢ÃƒÆ’Ã†â€™Ãƒâ€šÃ‚Â¢ÃƒÆ’Ã‚Â¢ÃƒÂ¢Ã¢â€šÂ¬Ã…Â¡Ãƒâ€šÃ‚Â¬ÃƒÆ’Ã¢â‚¬Â¦Ãƒâ€šÃ‚Â¡ÃƒÆ’Ã†â€™Ãƒâ€ Ã¢â‚¬â„¢ÃƒÆ’Ã‚Â¢ÃƒÂ¢Ã¢â‚¬Å¡Ã‚Â¬Ãƒâ€¦Ã‚Â¡ÃƒÆ’Ã†â€™ÃƒÂ¢Ã¢â€šÂ¬Ã…Â¡ÃƒÆ’Ã¢â‚¬Å¡Ãƒâ€šÃ‚Â¢ÃƒÆ’Ã†â€™Ãƒâ€ Ã¢â‚¬â„¢ÃƒÆ’Ã¢â‚¬Â ÃƒÂ¢Ã¢â€šÂ¬Ã¢â€žÂ¢ÃƒÆ’Ã†â€™ÃƒÂ¢Ã¢â€šÂ¬Ã‚Â ÃƒÆ’Ã‚Â¢ÃƒÂ¢Ã¢â‚¬Å¡Ã‚Â¬ÃƒÂ¢Ã¢â‚¬Å¾Ã‚Â¢ÃƒÆ’Ã†â€™Ãƒâ€ Ã¢â‚¬â„¢ÃƒÆ’Ã‚Â¢ÃƒÂ¢Ã¢â‚¬Å¡Ã‚Â¬Ãƒâ€¦Ã‚Â¡ÃƒÆ’Ã†â€™ÃƒÂ¢Ã¢â€šÂ¬Ã…Â¡ÃƒÆ’Ã¢â‚¬Å¡Ãƒâ€šÃ‚Â¢ÃƒÆ’Ã†â€™Ãƒâ€ Ã¢â‚¬â„¢ÃƒÆ’Ã¢â‚¬Â ÃƒÂ¢Ã¢â€šÂ¬Ã¢â€žÂ¢ÃƒÆ’Ã†â€™ÃƒÂ¢Ã¢â€šÂ¬Ã…Â¡ÃƒÆ’Ã¢â‚¬Å¡Ãƒâ€šÃ‚Â¢ÃƒÆ’Ã†â€™Ãƒâ€ Ã¢â‚¬â„¢ÃƒÆ’Ã¢â‚¬Å¡Ãƒâ€šÃ‚Â¢ÃƒÆ’Ã†â€™Ãƒâ€šÃ‚Â¢ÃƒÆ’Ã‚Â¢ÃƒÂ¢Ã¢â‚¬Å¡Ã‚Â¬Ãƒâ€¦Ã‚Â¡ÃƒÆ’Ã¢â‚¬Å¡Ãƒâ€šÃ‚Â¬ÃƒÆ’Ã†â€™ÃƒÂ¢Ã¢â€šÂ¬Ã‚Â¦ÃƒÆ’Ã¢â‚¬Å¡Ãƒâ€šÃ‚Â¡ÃƒÆ’Ã†â€™Ãƒâ€ Ã¢â‚¬â„¢ÃƒÆ’Ã‚Â¢ÃƒÂ¢Ã¢â‚¬Å¡Ã‚Â¬Ãƒâ€¦Ã‚Â¡ÃƒÆ’Ã†â€™ÃƒÂ¢Ã¢â€šÂ¬Ã…Â¡ÃƒÆ’Ã¢â‚¬Å¡Ãƒâ€šÃ‚Â¬ÃƒÆ’Ã†â€™Ãƒâ€ Ã¢â‚¬â„¢ÃƒÆ’Ã¢â‚¬Â ÃƒÂ¢Ã¢â€šÂ¬Ã¢â€žÂ¢ÃƒÆ’Ã†â€™Ãƒâ€šÃ‚Â¢ÃƒÆ’Ã‚Â¢ÃƒÂ¢Ã¢â€šÂ¬Ã…Â¡Ãƒâ€šÃ‚Â¬ÃƒÆ’Ã¢â‚¬Å¡Ãƒâ€šÃ‚Â¦ÃƒÆ’Ã†â€™Ãƒâ€ Ã¢â‚¬â„¢ÃƒÆ’Ã‚Â¢ÃƒÂ¢Ã¢â‚¬Å¡Ã‚Â¬Ãƒâ€¦Ã‚Â¡ÃƒÆ’Ã†â€™ÃƒÂ¢Ã¢â€šÂ¬Ã…Â¡ÃƒÆ’Ã¢â‚¬Å¡Ãƒâ€šÃ‚Â¡ÃƒÆ’Ã†â€™Ãƒâ€ Ã¢â‚¬â„¢ÃƒÆ’Ã¢â‚¬Â ÃƒÂ¢Ã¢â€šÂ¬Ã¢â€žÂ¢ÃƒÆ’Ã†â€™ÃƒÂ¢Ã¢â€šÂ¬Ã‚Â ÃƒÆ’Ã‚Â¢ÃƒÂ¢Ã¢â‚¬Å¡Ã‚Â¬ÃƒÂ¢Ã¢â‚¬Å¾Ã‚Â¢ÃƒÆ’Ã†â€™Ãƒâ€ Ã¢â‚¬â„¢ÃƒÆ’Ã¢â‚¬Å¡Ãƒâ€šÃ‚Â¢ÃƒÆ’Ã†â€™Ãƒâ€šÃ‚Â¢ÃƒÆ’Ã‚Â¢ÃƒÂ¢Ã¢â‚¬Å¡Ã‚Â¬Ãƒâ€¦Ã‚Â¡ÃƒÆ’Ã¢â‚¬Å¡Ãƒâ€šÃ‚Â¬ÃƒÆ’Ã†â€™ÃƒÂ¢Ã¢â€šÂ¬Ã‚Â¦ÃƒÆ’Ã¢â‚¬Å¡Ãƒâ€šÃ‚Â¡ÃƒÆ’Ã†â€™Ãƒâ€ Ã¢â‚¬â„¢ÃƒÆ’Ã¢â‚¬Â ÃƒÂ¢Ã¢â€šÂ¬Ã¢â€žÂ¢ÃƒÆ’Ã†â€™Ãƒâ€šÃ‚Â¢ÃƒÆ’Ã‚Â¢ÃƒÂ¢Ã¢â€šÂ¬Ã…Â¡Ãƒâ€šÃ‚Â¬ÃƒÆ’Ã¢â‚¬Â¦Ãƒâ€šÃ‚Â¡ÃƒÆ’Ã†â€™Ãƒâ€ Ã¢â‚¬â„¢ÃƒÆ’Ã‚Â¢ÃƒÂ¢Ã¢â‚¬Å¡Ã‚Â¬Ãƒâ€¦Ã‚Â¡ÃƒÆ’Ã†â€™ÃƒÂ¢Ã¢â€šÂ¬Ã…Â¡ÃƒÆ’Ã¢â‚¬Å¡Ãƒâ€šÃ‚Â¬ÃƒÆ’Ã†â€™Ãƒâ€ Ã¢â‚¬â„¢ÃƒÆ’Ã¢â‚¬Â ÃƒÂ¢Ã¢â€šÂ¬Ã¢â€žÂ¢ÃƒÆ’Ã†â€™ÃƒÂ¢Ã¢â€šÂ¬Ã‚Â ÃƒÆ’Ã‚Â¢ÃƒÂ¢Ã¢â‚¬Å¡Ã‚Â¬ÃƒÂ¢Ã¢â‚¬Å¾Ã‚Â¢ÃƒÆ’Ã†â€™Ãƒâ€ Ã¢â‚¬â„¢ÃƒÆ’Ã‚Â¢ÃƒÂ¢Ã¢â‚¬Å¡Ã‚Â¬Ãƒâ€šÃ‚Â ÃƒÆ’Ã†â€™Ãƒâ€šÃ‚Â¢ÃƒÆ’Ã‚Â¢ÃƒÂ¢Ã¢â€šÂ¬Ã…Â¡Ãƒâ€šÃ‚Â¬ÃƒÆ’Ã‚Â¢ÃƒÂ¢Ã¢â€šÂ¬Ã…Â¾Ãƒâ€šÃ‚Â¢ÃƒÆ’Ã†â€™Ãƒâ€ Ã¢â‚¬â„¢ÃƒÆ’Ã¢â‚¬Â ÃƒÂ¢Ã¢â€šÂ¬Ã¢â€žÂ¢ÃƒÆ’Ã†â€™Ãƒâ€šÃ‚Â¢ÃƒÆ’Ã‚Â¢ÃƒÂ¢Ã¢â€šÂ¬Ã…Â¡Ãƒâ€šÃ‚Â¬ÃƒÆ’Ã¢â‚¬Â¦Ãƒâ€šÃ‚Â¡ÃƒÆ’Ã†â€™Ãƒâ€ Ã¢â‚¬â„¢ÃƒÆ’Ã‚Â¢ÃƒÂ¢Ã¢â‚¬Å¡Ã‚Â¬Ãƒâ€¦Ã‚Â¡ÃƒÆ’Ã†â€™ÃƒÂ¢Ã¢â€šÂ¬Ã…Â¡ÃƒÆ’Ã¢â‚¬Å¡Ãƒâ€šÃ‚Â¢ÃƒÆ’Ã†â€™Ãƒâ€ Ã¢â‚¬â„¢ÃƒÆ’Ã¢â‚¬Â ÃƒÂ¢Ã¢â€šÂ¬Ã¢â€žÂ¢ÃƒÆ’Ã†â€™ÃƒÂ¢Ã¢â€šÂ¬Ã‚Â ÃƒÆ’Ã‚Â¢ÃƒÂ¢Ã¢â‚¬Å¡Ã‚Â¬ÃƒÂ¢Ã¢â‚¬Å¾Ã‚Â¢ÃƒÆ’Ã†â€™Ãƒâ€ Ã¢â‚¬â„¢ÃƒÆ’Ã‚Â¢ÃƒÂ¢Ã¢â‚¬Å¡Ã‚Â¬Ãƒâ€¦Ã‚Â¡ÃƒÆ’Ã†â€™ÃƒÂ¢Ã¢â€šÂ¬Ã…Â¡ÃƒÆ’Ã¢â‚¬Å¡Ãƒâ€šÃ‚Â¢ÃƒÆ’Ã†â€™Ãƒâ€ Ã¢â‚¬â„¢ÃƒÆ’Ã¢â‚¬Â ÃƒÂ¢Ã¢â€šÂ¬Ã¢â€žÂ¢ÃƒÆ’Ã†â€™ÃƒÂ¢Ã¢â€šÂ¬Ã…Â¡ÃƒÆ’Ã¢â‚¬Å¡Ãƒâ€šÃ‚Â¢ÃƒÆ’Ã†â€™Ãƒâ€ Ã¢â‚¬â„¢ÃƒÆ’Ã¢â‚¬Å¡Ãƒâ€šÃ‚Â¢ÃƒÆ’Ã†â€™Ãƒâ€šÃ‚Â¢ÃƒÆ’Ã‚Â¢ÃƒÂ¢Ã¢â€šÂ¬Ã…Â¡Ãƒâ€šÃ‚Â¬ÃƒÆ’Ã¢â‚¬Â¦Ãƒâ€šÃ‚Â¡ÃƒÆ’Ã†â€™ÃƒÂ¢Ã¢â€šÂ¬Ã…Â¡ÃƒÆ’Ã¢â‚¬Å¡Ãƒâ€šÃ‚Â¬ÃƒÆ’Ã†â€™Ãƒâ€ Ã¢â‚¬â„¢ÃƒÆ’Ã‚Â¢ÃƒÂ¢Ã¢â‚¬Å¡Ã‚Â¬Ãƒâ€šÃ‚Â¦ÃƒÆ’Ã†â€™ÃƒÂ¢Ã¢â€šÂ¬Ã…Â¡ÃƒÆ’Ã¢â‚¬Å¡Ãƒâ€šÃ‚Â¡ÃƒÆ’Ã†â€™Ãƒâ€ Ã¢â‚¬â„¢ÃƒÆ’Ã¢â‚¬Â ÃƒÂ¢Ã¢â€šÂ¬Ã¢â€žÂ¢ÃƒÆ’Ã†â€™Ãƒâ€šÃ‚Â¢ÃƒÆ’Ã‚Â¢ÃƒÂ¢Ã¢â€šÂ¬Ã…Â¡Ãƒâ€šÃ‚Â¬ÃƒÆ’Ã¢â‚¬Â¦Ãƒâ€šÃ‚Â¡ÃƒÆ’Ã†â€™Ãƒâ€ Ã¢â‚¬â„¢ÃƒÆ’Ã‚Â¢ÃƒÂ¢Ã¢â‚¬Å¡Ã‚Â¬Ãƒâ€¦Ã‚Â¡ÃƒÆ’Ã†â€™ÃƒÂ¢Ã¢â€šÂ¬Ã…Â¡ÃƒÆ’Ã¢â‚¬Å¡Ãƒâ€šÃ‚Â¬ÃƒÆ’Ã†â€™Ãƒâ€ Ã¢â‚¬â„¢ÃƒÆ’Ã¢â‚¬Â ÃƒÂ¢Ã¢â€šÂ¬Ã¢â€žÂ¢ÃƒÆ’Ã†â€™ÃƒÂ¢Ã¢â€šÂ¬Ã‚Â ÃƒÆ’Ã‚Â¢ÃƒÂ¢Ã¢â‚¬Å¡Ã‚Â¬ÃƒÂ¢Ã¢â‚¬Å¾Ã‚Â¢ÃƒÆ’Ã†â€™Ãƒâ€ Ã¢â‚¬â„¢ÃƒÆ’Ã¢â‚¬Å¡Ãƒâ€šÃ‚Â¢ÃƒÆ’Ã†â€™Ãƒâ€šÃ‚Â¢ÃƒÆ’Ã‚Â¢ÃƒÂ¢Ã¢â‚¬Å¡Ã‚Â¬Ãƒâ€¦Ã‚Â¡ÃƒÆ’Ã¢â‚¬Å¡Ãƒâ€šÃ‚Â¬ÃƒÆ’Ã†â€™ÃƒÂ¢Ã¢â€šÂ¬Ã…Â¡ÃƒÆ’Ã¢â‚¬Å¡Ãƒâ€šÃ‚Â¦ÃƒÆ’Ã†â€™Ãƒâ€ Ã¢â‚¬â„¢ÃƒÆ’Ã¢â‚¬Â ÃƒÂ¢Ã¢â€šÂ¬Ã¢â€žÂ¢ÃƒÆ’Ã†â€™ÃƒÂ¢Ã¢â€šÂ¬Ã…Â¡ÃƒÆ’Ã¢â‚¬Å¡Ãƒâ€šÃ‚Â¢ÃƒÆ’Ã†â€™Ãƒâ€ Ã¢â‚¬â„¢ÃƒÆ’Ã¢â‚¬Å¡Ãƒâ€šÃ‚Â¢ÃƒÆ’Ã†â€™Ãƒâ€šÃ‚Â¢ÃƒÆ’Ã‚Â¢ÃƒÂ¢Ã¢â€šÂ¬Ã…Â¡Ãƒâ€šÃ‚Â¬ÃƒÆ’Ã¢â‚¬Â¦Ãƒâ€šÃ‚Â¡ÃƒÆ’Ã†â€™ÃƒÂ¢Ã¢â€šÂ¬Ã…Â¡ÃƒÆ’Ã¢â‚¬Å¡Ãƒâ€šÃ‚Â¬ÃƒÆ’Ã†â€™Ãƒâ€ Ã¢â‚¬â„¢ÃƒÆ’Ã‚Â¢ÃƒÂ¢Ã¢â‚¬Å¡Ã‚Â¬Ãƒâ€šÃ‚Â¦ÃƒÆ’Ã†â€™Ãƒâ€šÃ‚Â¢ÃƒÆ’Ã‚Â¢ÃƒÂ¢Ã¢â€šÂ¬Ã…Â¡Ãƒâ€šÃ‚Â¬ÃƒÆ’Ã¢â‚¬Â¦ÃƒÂ¢Ã¢â€šÂ¬Ã…â€œ74 </w:t>
+        <w:t xml:space="preserve">By Week 7, sodium nitrite concentrations in both treatments had declined and stabilized at very similar levels, approximately 73ÃƒÆ’Ã†â€™Ãƒâ€ Ã¢â‚¬â„¢ÃƒÆ’Ã¢â‚¬Â ÃƒÂ¢Ã¢â€šÂ¬Ã¢â€žÂ¢ÃƒÆ’Ã†â€™ÃƒÂ¢Ã¢â€šÂ¬Ã‚Â ÃƒÆ’Ã‚Â¢ÃƒÂ¢Ã¢â‚¬Å¡Ã‚Â¬ÃƒÂ¢Ã¢â‚¬Å¾Ã‚Â¢ÃƒÆ’Ã†â€™Ãƒâ€ Ã¢â‚¬â„¢ÃƒÆ’Ã‚Â¢ÃƒÂ¢Ã¢â‚¬Å¡Ã‚Â¬Ãƒâ€šÃ‚Â ÃƒÆ’Ã†â€™Ãƒâ€šÃ‚Â¢ÃƒÆ’Ã‚Â¢ÃƒÂ¢Ã¢â€šÂ¬Ã…Â¡Ãƒâ€šÃ‚Â¬ÃƒÆ’Ã‚Â¢ÃƒÂ¢Ã¢â€šÂ¬Ã…Â¾Ãƒâ€šÃ‚Â¢ÃƒÆ’Ã†â€™Ãƒâ€ Ã¢â‚¬â„¢ÃƒÆ’Ã¢â‚¬Â ÃƒÂ¢Ã¢â€šÂ¬Ã¢â€žÂ¢ÃƒÆ’Ã†â€™Ãƒâ€šÃ‚Â¢ÃƒÆ’Ã‚Â¢ÃƒÂ¢Ã¢â€šÂ¬Ã…Â¡Ãƒâ€šÃ‚Â¬ÃƒÆ’Ã¢â‚¬Å¡Ãƒâ€šÃ‚Â ÃƒÆ’Ã†â€™Ãƒâ€ Ã¢â‚¬â„¢ÃƒÆ’Ã¢â‚¬Å¡Ãƒâ€šÃ‚Â¢ÃƒÆ’Ã†â€™Ãƒâ€šÃ‚Â¢ÃƒÆ’Ã‚Â¢ÃƒÂ¢Ã¢â‚¬Å¡Ã‚Â¬Ãƒâ€¦Ã‚Â¡ÃƒÆ’Ã¢â‚¬Å¡Ãƒâ€šÃ‚Â¬ÃƒÆ’Ã†â€™Ãƒâ€šÃ‚Â¢ÃƒÆ’Ã‚Â¢ÃƒÂ¢Ã¢â‚¬Å¡Ã‚Â¬Ãƒâ€¦Ã‚Â¾ÃƒÆ’Ã¢â‚¬Å¡Ãƒâ€šÃ‚Â¢ÃƒÆ’Ã†â€™Ãƒâ€ Ã¢â‚¬â„¢ÃƒÆ’Ã¢â‚¬Â ÃƒÂ¢Ã¢â€šÂ¬Ã¢â€žÂ¢ÃƒÆ’Ã†â€™ÃƒÂ¢Ã¢â€šÂ¬Ã‚Â ÃƒÆ’Ã‚Â¢ÃƒÂ¢Ã¢â‚¬Å¡Ã‚Â¬ÃƒÂ¢Ã¢â‚¬Å¾Ã‚Â¢ÃƒÆ’Ã†â€™Ãƒâ€ Ã¢â‚¬â„¢ÃƒÆ’Ã¢â‚¬Å¡Ãƒâ€šÃ‚Â¢ÃƒÆ’Ã†â€™Ãƒâ€šÃ‚Â¢ÃƒÆ’Ã‚Â¢ÃƒÂ¢Ã¢â‚¬Å¡Ã‚Â¬Ãƒâ€¦Ã‚Â¡ÃƒÆ’Ã¢â‚¬Å¡Ãƒâ€šÃ‚Â¬ÃƒÆ’Ã†â€™ÃƒÂ¢Ã¢â€šÂ¬Ã…Â¡ÃƒÆ’Ã¢â‚¬Å¡Ãƒâ€šÃ‚Â ÃƒÆ’Ã†â€™Ãƒâ€ Ã¢â‚¬â„¢ÃƒÆ’Ã¢â‚¬Â ÃƒÂ¢Ã¢â€šÂ¬Ã¢â€žÂ¢ÃƒÆ’Ã†â€™ÃƒÂ¢Ã¢â€šÂ¬Ã…Â¡ÃƒÆ’Ã¢â‚¬Å¡Ãƒâ€šÃ‚Â¢ÃƒÆ’Ã†â€™Ãƒâ€ Ã¢â‚¬â„¢ÃƒÆ’Ã¢â‚¬Å¡Ãƒâ€šÃ‚Â¢ÃƒÆ’Ã†â€™Ãƒâ€šÃ‚Â¢ÃƒÆ’Ã‚Â¢ÃƒÂ¢Ã¢â€šÂ¬Ã…Â¡Ãƒâ€šÃ‚Â¬ÃƒÆ’Ã¢â‚¬Â¦Ãƒâ€šÃ‚Â¡ÃƒÆ’Ã†â€™ÃƒÂ¢Ã¢â€šÂ¬Ã…Â¡ÃƒÆ’Ã¢â‚¬Å¡Ãƒâ€šÃ‚Â¬ÃƒÆ’Ã†â€™Ãƒâ€ Ã¢â‚¬â„¢ÃƒÆ’Ã¢â‚¬Å¡Ãƒâ€šÃ‚Â¢ÃƒÆ’Ã†â€™Ãƒâ€šÃ‚Â¢ÃƒÆ’Ã‚Â¢ÃƒÂ¢Ã¢â€šÂ¬Ã…Â¡Ãƒâ€šÃ‚Â¬ÃƒÆ’Ã¢â‚¬Â¦Ãƒâ€šÃ‚Â¾ÃƒÆ’Ã†â€™ÃƒÂ¢Ã¢â€šÂ¬Ã…Â¡ÃƒÆ’Ã¢â‚¬Å¡Ãƒâ€šÃ‚Â¢ÃƒÆ’Ã†â€™Ãƒâ€ Ã¢â‚¬â„¢ÃƒÆ’Ã¢â‚¬Â ÃƒÂ¢Ã¢â€šÂ¬Ã¢â€žÂ¢ÃƒÆ’Ã†â€™ÃƒÂ¢Ã¢â€šÂ¬Ã‚Â ÃƒÆ’Ã‚Â¢ÃƒÂ¢Ã¢â‚¬Å¡Ã‚Â¬ÃƒÂ¢Ã¢â‚¬Å¾Ã‚Â¢ÃƒÆ’Ã†â€™Ãƒâ€ Ã¢â‚¬â„¢ÃƒÆ’Ã‚Â¢ÃƒÂ¢Ã¢â‚¬Å¡Ã‚Â¬Ãƒâ€šÃ‚Â ÃƒÆ’Ã†â€™Ãƒâ€šÃ‚Â¢ÃƒÆ’Ã‚Â¢ÃƒÂ¢Ã¢â€šÂ¬Ã…Â¡Ãƒâ€šÃ‚Â¬ÃƒÆ’Ã‚Â¢ÃƒÂ¢Ã¢â€šÂ¬Ã…Â¾Ãƒâ€šÃ‚Â¢ÃƒÆ’Ã†â€™Ãƒâ€ Ã¢â‚¬â„¢ÃƒÆ’Ã¢â‚¬Â ÃƒÂ¢Ã¢â€šÂ¬Ã¢â€žÂ¢ÃƒÆ’Ã†â€™ÃƒÂ¢Ã¢â€šÂ¬Ã…Â¡ÃƒÆ’Ã¢â‚¬Å¡Ãƒâ€šÃ‚Â¢ÃƒÆ’Ã†â€™Ãƒâ€ Ã¢â‚¬â„¢ÃƒÆ’Ã¢â‚¬Å¡Ãƒâ€šÃ‚Â¢ÃƒÆ’Ã†â€™Ãƒâ€šÃ‚Â¢ÃƒÆ’Ã‚Â¢ÃƒÂ¢Ã¢â€šÂ¬Ã…Â¡Ãƒâ€šÃ‚Â¬ÃƒÆ’Ã¢â‚¬Â¦Ãƒâ€šÃ‚Â¡ÃƒÆ’Ã†â€™ÃƒÂ¢Ã¢â€šÂ¬Ã…Â¡ÃƒÆ’Ã¢â‚¬Å¡Ãƒâ€šÃ‚Â¬ÃƒÆ’Ã†â€™Ãƒâ€ Ã¢â‚¬â„¢ÃƒÆ’Ã‚Â¢ÃƒÂ¢Ã¢â‚¬Å¡Ã‚Â¬Ãƒâ€šÃ‚Â¦ÃƒÆ’Ã†â€™ÃƒÂ¢Ã¢â€šÂ¬Ã…Â¡ÃƒÆ’Ã¢â‚¬Å¡Ãƒâ€šÃ‚Â¡ÃƒÆ’Ã†â€™Ãƒâ€ Ã¢â‚¬â„¢ÃƒÆ’Ã¢â‚¬Â ÃƒÂ¢Ã¢â€šÂ¬Ã¢â€žÂ¢ÃƒÆ’Ã†â€™ÃƒÂ¢Ã¢â€šÂ¬Ã‚Â ÃƒÆ’Ã‚Â¢ÃƒÂ¢Ã¢â‚¬Å¡Ã‚Â¬ÃƒÂ¢Ã¢â‚¬Å¾Ã‚Â¢ÃƒÆ’Ã†â€™Ãƒâ€ Ã¢â‚¬â„¢ÃƒÆ’Ã¢â‚¬Å¡Ãƒâ€šÃ‚Â¢ÃƒÆ’Ã†â€™Ãƒâ€šÃ‚Â¢ÃƒÆ’Ã‚Â¢ÃƒÂ¢Ã¢â‚¬Å¡Ã‚Â¬Ãƒâ€¦Ã‚Â¡ÃƒÆ’Ã¢â‚¬Å¡Ãƒâ€šÃ‚Â¬ÃƒÆ’Ã†â€™ÃƒÂ¢Ã¢â€šÂ¬Ã‚Â¦ÃƒÆ’Ã¢â‚¬Å¡Ãƒâ€šÃ‚Â¡ÃƒÆ’Ã†â€™Ãƒâ€ Ã¢â‚¬â„¢ÃƒÆ’Ã¢â‚¬Â ÃƒÂ¢Ã¢â€šÂ¬Ã¢â€žÂ¢ÃƒÆ’Ã†â€™Ãƒâ€šÃ‚Â¢ÃƒÆ’Ã‚Â¢ÃƒÂ¢Ã¢â€šÂ¬Ã…Â¡Ãƒâ€šÃ‚Â¬ÃƒÆ’Ã¢â‚¬Â¦Ãƒâ€šÃ‚Â¡ÃƒÆ’Ã†â€™Ãƒâ€ Ã¢â‚¬â„¢ÃƒÆ’Ã‚Â¢ÃƒÂ¢Ã¢â‚¬Å¡Ã‚Â¬Ãƒâ€¦Ã‚Â¡ÃƒÆ’Ã†â€™ÃƒÂ¢Ã¢â€šÂ¬Ã…Â¡ÃƒÆ’Ã¢â‚¬Å¡Ãƒâ€šÃ‚Â¢ÃƒÆ’Ã†â€™Ãƒâ€ Ã¢â‚¬â„¢ÃƒÆ’Ã¢â‚¬Â ÃƒÂ¢Ã¢â€šÂ¬Ã¢â€žÂ¢ÃƒÆ’Ã†â€™ÃƒÂ¢Ã¢â€šÂ¬Ã‚Â ÃƒÆ’Ã‚Â¢ÃƒÂ¢Ã¢â‚¬Å¡Ã‚Â¬ÃƒÂ¢Ã¢â‚¬Å¾Ã‚Â¢ÃƒÆ’Ã†â€™Ãƒâ€ Ã¢â‚¬â„¢ÃƒÆ’Ã‚Â¢ÃƒÂ¢Ã¢â‚¬Å¡Ã‚Â¬Ãƒâ€šÃ‚Â ÃƒÆ’Ã†â€™Ãƒâ€šÃ‚Â¢ÃƒÆ’Ã‚Â¢ÃƒÂ¢Ã¢â€šÂ¬Ã…Â¡Ãƒâ€šÃ‚Â¬ÃƒÆ’Ã‚Â¢ÃƒÂ¢Ã¢â€šÂ¬Ã…Â¾Ãƒâ€šÃ‚Â¢ÃƒÆ’Ã†â€™Ãƒâ€ Ã¢â‚¬â„¢ÃƒÆ’Ã¢â‚¬Â ÃƒÂ¢Ã¢â€šÂ¬Ã¢â€žÂ¢ÃƒÆ’Ã†â€™Ãƒâ€šÃ‚Â¢ÃƒÆ’Ã‚Â¢ÃƒÂ¢Ã¢â€šÂ¬Ã…Â¡Ãƒâ€šÃ‚Â¬ÃƒÆ’Ã¢â‚¬Å¡Ãƒâ€šÃ‚Â ÃƒÆ’Ã†â€™Ãƒâ€ Ã¢â‚¬â„¢ÃƒÆ’Ã¢â‚¬Å¡Ãƒâ€šÃ‚Â¢ÃƒÆ’Ã†â€™Ãƒâ€šÃ‚Â¢ÃƒÆ’Ã‚Â¢ÃƒÂ¢Ã¢â‚¬Å¡Ã‚Â¬Ãƒâ€¦Ã‚Â¡ÃƒÆ’Ã¢â‚¬Å¡Ãƒâ€šÃ‚Â¬ÃƒÆ’Ã†â€™Ãƒâ€šÃ‚Â¢ÃƒÆ’Ã‚Â¢ÃƒÂ¢Ã¢â‚¬Å¡Ã‚Â¬Ãƒâ€¦Ã‚Â¾ÃƒÆ’Ã¢â‚¬Å¡Ãƒâ€šÃ‚Â¢ÃƒÆ’Ã†â€™Ãƒâ€ Ã¢â‚¬â„¢ÃƒÆ’Ã¢â‚¬Â ÃƒÂ¢Ã¢â€šÂ¬Ã¢â€žÂ¢ÃƒÆ’Ã†â€™ÃƒÂ¢Ã¢â€šÂ¬Ã‚Â ÃƒÆ’Ã‚Â¢ÃƒÂ¢Ã¢â‚¬Å¡Ã‚Â¬ÃƒÂ¢Ã¢â‚¬Å¾Ã‚Â¢ÃƒÆ’Ã†â€™Ãƒâ€ Ã¢â‚¬â„¢ÃƒÆ’Ã¢â‚¬Å¡Ãƒâ€šÃ‚Â¢ÃƒÆ’Ã†â€™Ãƒâ€šÃ‚Â¢ÃƒÆ’Ã‚Â¢ÃƒÂ¢Ã¢â‚¬Å¡Ã‚Â¬Ãƒâ€¦Ã‚Â¡ÃƒÆ’Ã¢â‚¬Å¡Ãƒâ€šÃ‚Â¬ÃƒÆ’Ã†â€™ÃƒÂ¢Ã¢â€šÂ¬Ã‚Â¦ÃƒÆ’Ã¢â‚¬Å¡Ãƒâ€šÃ‚Â¡ÃƒÆ’Ã†â€™Ãƒâ€ Ã¢â‚¬â„¢ÃƒÆ’Ã¢â‚¬Â ÃƒÂ¢Ã¢â€šÂ¬Ã¢â€žÂ¢ÃƒÆ’Ã†â€™Ãƒâ€šÃ‚Â¢ÃƒÆ’Ã‚Â¢ÃƒÂ¢Ã¢â€šÂ¬Ã…Â¡Ãƒâ€šÃ‚Â¬ÃƒÆ’Ã¢â‚¬Â¦Ãƒâ€šÃ‚Â¡ÃƒÆ’Ã†â€™Ãƒâ€ Ã¢â‚¬â„¢ÃƒÆ’Ã‚Â¢ÃƒÂ¢Ã¢â‚¬Å¡Ã‚Â¬Ãƒâ€¦Ã‚Â¡ÃƒÆ’Ã†â€™ÃƒÂ¢Ã¢â€šÂ¬Ã…Â¡ÃƒÆ’Ã¢â‚¬Å¡Ãƒâ€šÃ‚Â¢ÃƒÆ’Ã†â€™Ãƒâ€ Ã¢â‚¬â„¢ÃƒÆ’Ã¢â‚¬Â ÃƒÂ¢Ã¢â€šÂ¬Ã¢â€žÂ¢ÃƒÆ’Ã†â€™ÃƒÂ¢Ã¢â€šÂ¬Ã‚Â ÃƒÆ’Ã‚Â¢ÃƒÂ¢Ã¢â‚¬Å¡Ã‚Â¬ÃƒÂ¢Ã¢â‚¬Å¾Ã‚Â¢ÃƒÆ’Ã†â€™Ãƒâ€ Ã¢â‚¬â„¢ÃƒÆ’Ã‚Â¢ÃƒÂ¢Ã¢â‚¬Å¡Ã‚Â¬Ãƒâ€šÃ‚Â ÃƒÆ’Ã†â€™Ãƒâ€šÃ‚Â¢ÃƒÆ’Ã‚Â¢ÃƒÂ¢Ã¢â€šÂ¬Ã…Â¡Ãƒâ€šÃ‚Â¬ÃƒÆ’Ã‚Â¢ÃƒÂ¢Ã¢â€šÂ¬Ã…Â¾Ãƒâ€šÃ‚Â¢ÃƒÆ’Ã†â€™Ãƒâ€ Ã¢â‚¬â„¢ÃƒÆ’Ã¢â‚¬Â ÃƒÂ¢Ã¢â€šÂ¬Ã¢â€žÂ¢ÃƒÆ’Ã†â€™Ãƒâ€šÃ‚Â¢ÃƒÆ’Ã‚Â¢ÃƒÂ¢Ã¢â€šÂ¬Ã…Â¡Ãƒâ€šÃ‚Â¬ÃƒÆ’Ã¢â‚¬Â¦Ãƒâ€šÃ‚Â¡ÃƒÆ’Ã†â€™Ãƒâ€ Ã¢â‚¬â„¢ÃƒÆ’Ã‚Â¢ÃƒÂ¢Ã¢â‚¬Å¡Ã‚Â¬Ãƒâ€¦Ã‚Â¡ÃƒÆ’Ã†â€™ÃƒÂ¢Ã¢â€šÂ¬Ã…Â¡ÃƒÆ’Ã¢â‚¬Å¡Ãƒâ€šÃ‚Â¢ÃƒÆ’Ã†â€™Ãƒâ€ Ã¢â‚¬â„¢ÃƒÆ’Ã¢â‚¬Â ÃƒÂ¢Ã¢â€šÂ¬Ã¢â€žÂ¢ÃƒÆ’Ã†â€™ÃƒÂ¢Ã¢â€šÂ¬Ã‚Â ÃƒÆ’Ã‚Â¢ÃƒÂ¢Ã¢â‚¬Å¡Ã‚Â¬ÃƒÂ¢Ã¢â‚¬Å¾Ã‚Â¢ÃƒÆ’Ã†â€™Ãƒâ€ Ã¢â‚¬â„¢ÃƒÆ’Ã‚Â¢ÃƒÂ¢Ã¢â‚¬Å¡Ã‚Â¬Ãƒâ€¦Ã‚Â¡ÃƒÆ’Ã†â€™ÃƒÂ¢Ã¢â€šÂ¬Ã…Â¡ÃƒÆ’Ã¢â‚¬Å¡Ãƒâ€šÃ‚Â¢ÃƒÆ’Ã†â€™Ãƒâ€ Ã¢â‚¬â„¢ÃƒÆ’Ã¢â‚¬Â ÃƒÂ¢Ã¢â€šÂ¬Ã¢â€žÂ¢ÃƒÆ’Ã†â€™ÃƒÂ¢Ã¢â€šÂ¬Ã…Â¡ÃƒÆ’Ã¢â‚¬Å¡Ãƒâ€šÃ‚Â¢ÃƒÆ’Ã†â€™Ãƒâ€ Ã¢â‚¬â„¢ÃƒÆ’Ã¢â‚¬Å¡Ãƒâ€šÃ‚Â¢ÃƒÆ’Ã†â€™Ãƒâ€šÃ‚Â¢ÃƒÆ’Ã‚Â¢ÃƒÂ¢Ã¢â€šÂ¬Ã…Â¡Ãƒâ€šÃ‚Â¬ÃƒÆ’Ã¢â‚¬Â¦Ãƒâ€šÃ‚Â¡ÃƒÆ’Ã†â€™ÃƒÂ¢Ã¢â€šÂ¬Ã…Â¡ÃƒÆ’Ã¢â‚¬Å¡Ãƒâ€šÃ‚Â¬ÃƒÆ’Ã†â€™Ãƒâ€ Ã¢â‚¬â„¢ÃƒÆ’Ã‚Â¢ÃƒÂ¢Ã¢â‚¬Å¡Ã‚Â¬Ãƒâ€šÃ‚Â¦ÃƒÆ’Ã†â€™ÃƒÂ¢Ã¢â€šÂ¬Ã…Â¡ÃƒÆ’Ã¢â‚¬Å¡Ãƒâ€šÃ‚Â¡ÃƒÆ’Ã†â€™Ãƒâ€ Ã¢â‚¬â„¢ÃƒÆ’Ã¢â‚¬Â ÃƒÂ¢Ã¢â€šÂ¬Ã¢â€žÂ¢ÃƒÆ’Ã†â€™Ãƒâ€šÃ‚Â¢ÃƒÆ’Ã‚Â¢ÃƒÂ¢Ã¢â€šÂ¬Ã…Â¡Ãƒâ€šÃ‚Â¬ÃƒÆ’Ã¢â‚¬Â¦Ãƒâ€šÃ‚Â¡ÃƒÆ’Ã†â€™Ãƒâ€ Ã¢â‚¬â„¢ÃƒÆ’Ã‚Â¢ÃƒÂ¢Ã¢â‚¬Å¡Ã‚Â¬Ãƒâ€¦Ã‚Â¡ÃƒÆ’Ã†â€™ÃƒÂ¢Ã¢â€šÂ¬Ã…Â¡ÃƒÆ’Ã¢â‚¬Å¡Ãƒâ€šÃ‚Â¬ÃƒÆ’Ã†â€™Ãƒâ€ Ã¢â‚¬â„¢ÃƒÆ’Ã¢â‚¬Â ÃƒÂ¢Ã¢â€šÂ¬Ã¢â€žÂ¢ÃƒÆ’Ã†â€™ÃƒÂ¢Ã¢â€šÂ¬Ã‚Â ÃƒÆ’Ã‚Â¢ÃƒÂ¢Ã¢â‚¬Å¡Ã‚Â¬ÃƒÂ¢Ã¢â‚¬Å¾Ã‚Â¢ÃƒÆ’Ã†â€™Ãƒâ€ Ã¢â‚¬â„¢ÃƒÆ’Ã¢â‚¬Å¡Ãƒâ€šÃ‚Â¢ÃƒÆ’Ã†â€™Ãƒâ€šÃ‚Â¢ÃƒÆ’Ã‚Â¢ÃƒÂ¢Ã¢â‚¬Å¡Ã‚Â¬Ãƒâ€¦Ã‚Â¡ÃƒÆ’Ã¢â‚¬Å¡Ãƒâ€šÃ‚Â¬ÃƒÆ’Ã†â€™ÃƒÂ¢Ã¢â€šÂ¬Ã…Â¡ÃƒÆ’Ã¢â‚¬Å¡Ãƒâ€šÃ‚Â¦ÃƒÆ’Ã†â€™Ãƒâ€ Ã¢â‚¬â„¢ÃƒÆ’Ã¢â‚¬Â ÃƒÂ¢Ã¢â€šÂ¬Ã¢â€žÂ¢ÃƒÆ’Ã†â€™Ãƒâ€šÃ‚Â¢ÃƒÆ’Ã‚Â¢ÃƒÂ¢Ã¢â€šÂ¬Ã…Â¡Ãƒâ€šÃ‚Â¬ÃƒÆ’Ã¢â‚¬Â¦Ãƒâ€šÃ‚Â¡ÃƒÆ’Ã†â€™Ãƒâ€ Ã¢â‚¬â„¢ÃƒÆ’Ã‚Â¢ÃƒÂ¢Ã¢â‚¬Å¡Ã‚Â¬Ãƒâ€¦Ã‚Â¡ÃƒÆ’Ã†â€™ÃƒÂ¢Ã¢â€šÂ¬Ã…Â¡ÃƒÆ’Ã¢â‚¬Å¡Ãƒâ€šÃ‚Â¡ÃƒÆ’Ã†â€™Ãƒâ€ Ã¢â‚¬â„¢ÃƒÆ’Ã¢â‚¬Â ÃƒÂ¢Ã¢â€šÂ¬Ã¢â€žÂ¢ÃƒÆ’Ã†â€™ÃƒÂ¢Ã¢â€šÂ¬Ã‚Â ÃƒÆ’Ã‚Â¢ÃƒÂ¢Ã¢â‚¬Å¡Ã‚Â¬ÃƒÂ¢Ã¢â‚¬Å¾Ã‚Â¢ÃƒÆ’Ã†â€™Ãƒâ€ Ã¢â‚¬â„¢ÃƒÆ’Ã‚Â¢ÃƒÂ¢Ã¢â‚¬Å¡Ã‚Â¬Ãƒâ€šÃ‚Â ÃƒÆ’Ã†â€™Ãƒâ€šÃ‚Â¢ÃƒÆ’Ã‚Â¢ÃƒÂ¢Ã¢â€šÂ¬Ã…Â¡Ãƒâ€šÃ‚Â¬ÃƒÆ’Ã‚Â¢ÃƒÂ¢Ã¢â€šÂ¬Ã…Â¾Ãƒâ€šÃ‚Â¢ÃƒÆ’Ã†â€™Ãƒâ€ Ã¢â‚¬â„¢ÃƒÆ’Ã¢â‚¬Â ÃƒÂ¢Ã¢â€šÂ¬Ã¢â€žÂ¢ÃƒÆ’Ã†â€™ÃƒÂ¢Ã¢â€šÂ¬Ã…Â¡ÃƒÆ’Ã¢â‚¬Å¡Ãƒâ€šÃ‚Â¢ÃƒÆ’Ã†â€™Ãƒâ€ Ã¢â‚¬â„¢ÃƒÆ’Ã¢â‚¬Å¡Ãƒâ€šÃ‚Â¢ÃƒÆ’Ã†â€™Ãƒâ€šÃ‚Â¢ÃƒÆ’Ã‚Â¢ÃƒÂ¢Ã¢â€šÂ¬Ã…Â¡Ãƒâ€šÃ‚Â¬ÃƒÆ’Ã¢â‚¬Â¦Ãƒâ€šÃ‚Â¡ÃƒÆ’Ã†â€™ÃƒÂ¢Ã¢â€šÂ¬Ã…Â¡ÃƒÆ’Ã¢â‚¬Å¡Ãƒâ€šÃ‚Â¬ÃƒÆ’Ã†â€™Ãƒâ€ Ã¢â‚¬â„¢ÃƒÆ’Ã‚Â¢ÃƒÂ¢Ã¢â‚¬Å¡Ã‚Â¬Ãƒâ€šÃ‚Â¦ÃƒÆ’Ã†â€™ÃƒÂ¢Ã¢â€šÂ¬Ã…Â¡ÃƒÆ’Ã¢â‚¬Å¡Ãƒâ€šÃ‚Â¡ÃƒÆ’Ã†â€™Ãƒâ€ Ã¢â‚¬â„¢ÃƒÆ’Ã¢â‚¬Â ÃƒÂ¢Ã¢â€šÂ¬Ã¢â€žÂ¢ÃƒÆ’Ã†â€™ÃƒÂ¢Ã¢â€šÂ¬Ã‚Â ÃƒÆ’Ã‚Â¢ÃƒÂ¢Ã¢â‚¬Å¡Ã‚Â¬ÃƒÂ¢Ã¢â‚¬Å¾Ã‚Â¢ÃƒÆ’Ã†â€™Ãƒâ€ Ã¢â‚¬â„¢ÃƒÆ’Ã¢â‚¬Å¡Ãƒâ€šÃ‚Â¢ÃƒÆ’Ã†â€™Ãƒâ€šÃ‚Â¢ÃƒÆ’Ã‚Â¢ÃƒÂ¢Ã¢â‚¬Å¡Ã‚Â¬Ãƒâ€¦Ã‚Â¡ÃƒÆ’Ã¢â‚¬Å¡Ãƒâ€šÃ‚Â¬ÃƒÆ’Ã†â€™ÃƒÂ¢Ã¢â€šÂ¬Ã‚Â¦ÃƒÆ’Ã¢â‚¬Å¡Ãƒâ€šÃ‚Â¡ÃƒÆ’Ã†â€™Ãƒâ€ Ã¢â‚¬â„¢ÃƒÆ’Ã¢â‚¬Â ÃƒÂ¢Ã¢â€šÂ¬Ã¢â€žÂ¢ÃƒÆ’Ã†â€™Ãƒâ€šÃ‚Â¢ÃƒÆ’Ã‚Â¢ÃƒÂ¢Ã¢â€šÂ¬Ã…Â¡Ãƒâ€šÃ‚Â¬ÃƒÆ’Ã¢â‚¬Â¦Ãƒâ€šÃ‚Â¡ÃƒÆ’Ã†â€™Ãƒâ€ Ã¢â‚¬â„¢ÃƒÆ’Ã‚Â¢ÃƒÂ¢Ã¢â‚¬Å¡Ã‚Â¬Ãƒâ€¦Ã‚Â¡ÃƒÆ’Ã†â€™ÃƒÂ¢Ã¢â€šÂ¬Ã…Â¡ÃƒÆ’Ã¢â‚¬Å¡Ãƒâ€šÃ‚Â¬ÃƒÆ’Ã†â€™Ãƒâ€ Ã¢â‚¬â„¢ÃƒÆ’Ã¢â‚¬Â ÃƒÂ¢Ã¢â€šÂ¬Ã¢â€žÂ¢ÃƒÆ’Ã†â€™ÃƒÂ¢Ã¢â€šÂ¬Ã‚Â ÃƒÆ’Ã‚Â¢ÃƒÂ¢Ã¢â‚¬Å¡Ã‚Â¬ÃƒÂ¢Ã¢â‚¬Å¾Ã‚Â¢ÃƒÆ’Ã†â€™Ãƒâ€ Ã¢â‚¬â„¢ÃƒÆ’Ã‚Â¢ÃƒÂ¢Ã¢â‚¬Å¡Ã‚Â¬Ãƒâ€šÃ‚Â ÃƒÆ’Ã†â€™Ãƒâ€šÃ‚Â¢ÃƒÆ’Ã‚Â¢ÃƒÂ¢Ã¢â€šÂ¬Ã…Â¡Ãƒâ€šÃ‚Â¬ÃƒÆ’Ã‚Â¢ÃƒÂ¢Ã¢â€šÂ¬Ã…Â¾Ãƒâ€šÃ‚Â¢ÃƒÆ’Ã†â€™Ãƒâ€ Ã¢â‚¬â„¢ÃƒÆ’Ã¢â‚¬Â ÃƒÂ¢Ã¢â€šÂ¬Ã¢â€žÂ¢ÃƒÆ’Ã†â€™Ãƒâ€šÃ‚Â¢ÃƒÆ’Ã‚Â¢ÃƒÂ¢Ã¢â€šÂ¬Ã…Â¡Ãƒâ€šÃ‚Â¬ÃƒÆ’Ã¢â‚¬Å¡Ãƒâ€šÃ‚Â ÃƒÆ’Ã†â€™Ãƒâ€ Ã¢â‚¬â„¢ÃƒÆ’Ã¢â‚¬Å¡Ãƒâ€šÃ‚Â¢ÃƒÆ’Ã†â€™Ãƒâ€šÃ‚Â¢ÃƒÆ’Ã‚Â¢ÃƒÂ¢Ã¢â‚¬Å¡Ã‚Â¬Ãƒâ€¦Ã‚Â¡ÃƒÆ’Ã¢â‚¬Å¡Ãƒâ€šÃ‚Â¬ÃƒÆ’Ã†â€™Ãƒâ€šÃ‚Â¢ÃƒÆ’Ã‚Â¢ÃƒÂ¢Ã¢â‚¬Å¡Ã‚Â¬Ãƒâ€¦Ã‚Â¾ÃƒÆ’Ã¢â‚¬Å¡Ãƒâ€šÃ‚Â¢ÃƒÆ’Ã†â€™Ãƒâ€ Ã¢â‚¬â„¢ÃƒÆ’Ã¢â‚¬Â ÃƒÂ¢Ã¢â€šÂ¬Ã¢â€žÂ¢ÃƒÆ’Ã†â€™ÃƒÂ¢Ã¢â€šÂ¬Ã‚Â ÃƒÆ’Ã‚Â¢ÃƒÂ¢Ã¢â‚¬Å¡Ã‚Â¬ÃƒÂ¢Ã¢â‚¬Å¾Ã‚Â¢ÃƒÆ’Ã†â€™Ãƒâ€ Ã¢â‚¬â„¢ÃƒÆ’Ã¢â‚¬Å¡Ãƒâ€šÃ‚Â¢ÃƒÆ’Ã†â€™Ãƒâ€šÃ‚Â¢ÃƒÆ’Ã‚Â¢ÃƒÂ¢Ã¢â‚¬Å¡Ã‚Â¬Ãƒâ€¦Ã‚Â¡ÃƒÆ’Ã¢â‚¬Å¡Ãƒâ€šÃ‚Â¬ÃƒÆ’Ã†â€™ÃƒÂ¢Ã¢â€šÂ¬Ã‚Â¦ÃƒÆ’Ã¢â‚¬Å¡Ãƒâ€šÃ‚Â¡ÃƒÆ’Ã†â€™Ãƒâ€ Ã¢â‚¬â„¢ÃƒÆ’Ã¢â‚¬Â ÃƒÂ¢Ã¢â€šÂ¬Ã¢â€žÂ¢ÃƒÆ’Ã†â€™Ãƒâ€šÃ‚Â¢ÃƒÆ’Ã‚Â¢ÃƒÂ¢Ã¢â€šÂ¬Ã…Â¡Ãƒâ€šÃ‚Â¬ÃƒÆ’Ã¢â‚¬Â¦Ãƒâ€šÃ‚Â¡ÃƒÆ’Ã†â€™Ãƒâ€ Ã¢â‚¬â„¢ÃƒÆ’Ã‚Â¢ÃƒÂ¢Ã¢â‚¬Å¡Ã‚Â¬Ãƒâ€¦Ã‚Â¡ÃƒÆ’Ã†â€™ÃƒÂ¢Ã¢â€šÂ¬Ã…Â¡ÃƒÆ’Ã¢â‚¬Å¡Ãƒâ€šÃ‚Â¢ÃƒÆ’Ã†â€™Ãƒâ€ Ã¢â‚¬â„¢ÃƒÆ’Ã¢â‚¬Â ÃƒÂ¢Ã¢â€šÂ¬Ã¢â€žÂ¢ÃƒÆ’Ã†â€™ÃƒÂ¢Ã¢â€šÂ¬Ã‚Â ÃƒÆ’Ã‚Â¢ÃƒÂ¢Ã¢â‚¬Å¡Ã‚Â¬ÃƒÂ¢Ã¢â‚¬Å¾Ã‚Â¢ÃƒÆ’Ã†â€™Ãƒâ€ Ã¢â‚¬â„¢ÃƒÆ’Ã‚Â¢ÃƒÂ¢Ã¢â‚¬Å¡Ã‚Â¬Ãƒâ€šÃ‚Â ÃƒÆ’Ã†â€™Ãƒâ€šÃ‚Â¢ÃƒÆ’Ã‚Â¢ÃƒÂ¢Ã¢â€šÂ¬Ã…Â¡Ãƒâ€šÃ‚Â¬ÃƒÆ’Ã‚Â¢ÃƒÂ¢Ã¢â€šÂ¬Ã…Â¾Ãƒâ€šÃ‚Â¢ÃƒÆ’Ã†â€™Ãƒâ€ Ã¢â‚¬â„¢ÃƒÆ’Ã¢â‚¬Â ÃƒÂ¢Ã¢â€šÂ¬Ã¢â€žÂ¢ÃƒÆ’Ã†â€™Ãƒâ€šÃ‚Â¢ÃƒÆ’Ã‚Â¢ÃƒÂ¢Ã¢â€šÂ¬Ã…Â¡Ãƒâ€šÃ‚Â¬ÃƒÆ’Ã¢â‚¬Â¦Ãƒâ€šÃ‚Â¡ÃƒÆ’Ã†â€™Ãƒâ€ Ã¢â‚¬â„¢ÃƒÆ’Ã‚Â¢ÃƒÂ¢Ã¢â‚¬Å¡Ã‚Â¬Ãƒâ€¦Ã‚Â¡ÃƒÆ’Ã†â€™ÃƒÂ¢Ã¢â€šÂ¬Ã…Â¡ÃƒÆ’Ã¢â‚¬Å¡Ãƒâ€šÃ‚Â¢ÃƒÆ’Ã†â€™Ãƒâ€ Ã¢â‚¬â„¢ÃƒÆ’Ã¢â‚¬Â ÃƒÂ¢Ã¢â€šÂ¬Ã¢â€žÂ¢ÃƒÆ’Ã†â€™ÃƒÂ¢Ã¢â€šÂ¬Ã‚Â ÃƒÆ’Ã‚Â¢ÃƒÂ¢Ã¢â‚¬Å¡Ã‚Â¬ÃƒÂ¢Ã¢â‚¬Å¾Ã‚Â¢ÃƒÆ’Ã†â€™Ãƒâ€ Ã¢â‚¬â„¢ÃƒÆ’Ã‚Â¢ÃƒÂ¢Ã¢â‚¬Å¡Ã‚Â¬Ãƒâ€¦Ã‚Â¡ÃƒÆ’Ã†â€™ÃƒÂ¢Ã¢â€šÂ¬Ã…Â¡ÃƒÆ’Ã¢â‚¬Å¡Ãƒâ€šÃ‚Â¢ÃƒÆ’Ã†â€™Ãƒâ€ Ã¢â‚¬â„¢ÃƒÆ’Ã¢â‚¬Â ÃƒÂ¢Ã¢â€šÂ¬Ã¢â€žÂ¢ÃƒÆ’Ã†â€™ÃƒÂ¢Ã¢â€šÂ¬Ã…Â¡ÃƒÆ’Ã¢â‚¬Å¡Ãƒâ€šÃ‚Â¢ÃƒÆ’Ã†â€™Ãƒâ€ Ã¢â‚¬â„¢ÃƒÆ’Ã¢â‚¬Å¡Ãƒâ€šÃ‚Â¢ÃƒÆ’Ã†â€™Ãƒâ€šÃ‚Â¢ÃƒÆ’Ã‚Â¢ÃƒÂ¢Ã¢â‚¬Å¡Ã‚Â¬Ãƒâ€¦Ã‚Â¡ÃƒÆ’Ã¢â‚¬Å¡Ãƒâ€šÃ‚Â¬ÃƒÆ’Ã†â€™ÃƒÂ¢Ã¢â€šÂ¬Ã‚Â¦ÃƒÆ’Ã¢â‚¬Å¡Ãƒâ€šÃ‚Â¡ÃƒÆ’Ã†â€™Ãƒâ€ Ã¢â‚¬â„¢ÃƒÆ’Ã‚Â¢ÃƒÂ¢Ã¢â‚¬Å¡Ã‚Â¬Ãƒâ€¦Ã‚Â¡ÃƒÆ’Ã†â€™ÃƒÂ¢Ã¢â€šÂ¬Ã…Â¡ÃƒÆ’Ã¢â‚¬Å¡Ãƒâ€šÃ‚Â¬ÃƒÆ’Ã†â€™Ãƒâ€ Ã¢â‚¬â„¢ÃƒÆ’Ã¢â‚¬Â ÃƒÂ¢Ã¢â€šÂ¬Ã¢â€žÂ¢ÃƒÆ’Ã†â€™Ãƒâ€šÃ‚Â¢ÃƒÆ’Ã‚Â¢ÃƒÂ¢Ã¢â€šÂ¬Ã…Â¡Ãƒâ€šÃ‚Â¬ÃƒÆ’Ã¢â‚¬Å¡Ãƒâ€šÃ‚Â¦ÃƒÆ’Ã†â€™Ãƒâ€ Ã¢â‚¬â„¢ÃƒÆ’Ã‚Â¢ÃƒÂ¢Ã¢â‚¬Å¡Ã‚Â¬Ãƒâ€¦Ã‚Â¡ÃƒÆ’Ã†â€™ÃƒÂ¢Ã¢â€šÂ¬Ã…Â¡ÃƒÆ’Ã¢â‚¬Å¡Ãƒâ€šÃ‚Â¡ÃƒÆ’Ã†â€™Ãƒâ€ Ã¢â‚¬â„¢ÃƒÆ’Ã¢â‚¬Â ÃƒÂ¢Ã¢â€šÂ¬Ã¢â€žÂ¢ÃƒÆ’Ã†â€™ÃƒÂ¢Ã¢â€šÂ¬Ã‚Â ÃƒÆ’Ã‚Â¢ÃƒÂ¢Ã¢â‚¬Å¡Ã‚Â¬ÃƒÂ¢Ã¢â‚¬Å¾Ã‚Â¢ÃƒÆ’Ã†â€™Ãƒâ€ Ã¢â‚¬â„¢ÃƒÆ’Ã¢â‚¬Å¡Ãƒâ€šÃ‚Â¢ÃƒÆ’Ã†â€™Ãƒâ€šÃ‚Â¢ÃƒÆ’Ã‚Â¢ÃƒÂ¢Ã¢â‚¬Å¡Ã‚Â¬Ãƒâ€¦Ã‚Â¡ÃƒÆ’Ã¢â‚¬Å¡Ãƒâ€šÃ‚Â¬ÃƒÆ’Ã†â€™ÃƒÂ¢Ã¢â€šÂ¬Ã‚Â¦ÃƒÆ’Ã¢â‚¬Å¡Ãƒâ€šÃ‚Â¡ÃƒÆ’Ã†â€™Ãƒâ€ Ã¢â‚¬â„¢ÃƒÆ’Ã¢â‚¬Â ÃƒÂ¢Ã¢â€šÂ¬Ã¢â€žÂ¢ÃƒÆ’Ã†â€™Ãƒâ€šÃ‚Â¢ÃƒÆ’Ã‚Â¢ÃƒÂ¢Ã¢â€šÂ¬Ã…Â¡Ãƒâ€šÃ‚Â¬ÃƒÆ’Ã¢â‚¬Â¦Ãƒâ€šÃ‚Â¡ÃƒÆ’Ã†â€™Ãƒâ€ Ã¢â‚¬â„¢ÃƒÆ’Ã‚Â¢ÃƒÂ¢Ã¢â‚¬Å¡Ã‚Â¬Ãƒâ€¦Ã‚Â¡ÃƒÆ’Ã†â€™ÃƒÂ¢Ã¢â€šÂ¬Ã…Â¡ÃƒÆ’Ã¢â‚¬Å¡Ãƒâ€šÃ‚Â¬ÃƒÆ’Ã†â€™Ãƒâ€ Ã¢â‚¬â„¢ÃƒÆ’Ã¢â‚¬Â ÃƒÂ¢Ã¢â€šÂ¬Ã¢â€žÂ¢ÃƒÆ’Ã†â€™ÃƒÂ¢Ã¢â€šÂ¬Ã‚Â ÃƒÆ’Ã‚Â¢ÃƒÂ¢Ã¢â‚¬Å¡Ã‚Â¬ÃƒÂ¢Ã¢â‚¬Å¾Ã‚Â¢ÃƒÆ’Ã†â€™Ãƒâ€ Ã¢â‚¬â„¢ÃƒÆ’Ã‚Â¢ÃƒÂ¢Ã¢â‚¬Å¡Ã‚Â¬Ãƒâ€šÃ‚Â ÃƒÆ’Ã†â€™Ãƒâ€šÃ‚Â¢ÃƒÆ’Ã‚Â¢ÃƒÂ¢Ã¢â€šÂ¬Ã…Â¡Ãƒâ€šÃ‚Â¬ÃƒÆ’Ã‚Â¢ÃƒÂ¢Ã¢â€šÂ¬Ã…Â¾Ãƒâ€šÃ‚Â¢ÃƒÆ’Ã†â€™Ãƒâ€ Ã¢â‚¬â„¢ÃƒÆ’Ã¢â‚¬Â ÃƒÂ¢Ã¢â€šÂ¬Ã¢â€žÂ¢ÃƒÆ’Ã†â€™ÃƒÂ¢Ã¢â€šÂ¬Ã…Â¡ÃƒÆ’Ã¢â‚¬Å¡Ãƒâ€šÃ‚Â¢ÃƒÆ’Ã†â€™Ãƒâ€ Ã¢â‚¬â„¢ÃƒÆ’Ã¢â‚¬Å¡Ãƒâ€šÃ‚Â¢ÃƒÆ’Ã†â€™Ãƒâ€šÃ‚Â¢ÃƒÆ’Ã‚Â¢ÃƒÂ¢Ã¢â€šÂ¬Ã…Â¡Ãƒâ€šÃ‚Â¬ÃƒÆ’Ã¢â‚¬Â¦Ãƒâ€šÃ‚Â¡ÃƒÆ’Ã†â€™ÃƒÂ¢Ã¢â€šÂ¬Ã…Â¡ÃƒÆ’Ã¢â‚¬Å¡Ãƒâ€šÃ‚Â¬ÃƒÆ’Ã†â€™Ãƒâ€ Ã¢â‚¬â„¢ÃƒÆ’Ã‚Â¢ÃƒÂ¢Ã¢â‚¬Å¡Ã‚Â¬Ãƒâ€¦Ã‚Â¡ÃƒÆ’Ã†â€™ÃƒÂ¢Ã¢â€šÂ¬Ã…Â¡ÃƒÆ’Ã¢â‚¬Å¡Ãƒâ€šÃ‚Â¦ÃƒÆ’Ã†â€™Ãƒâ€ Ã¢â‚¬â„¢ÃƒÆ’Ã¢â‚¬Â ÃƒÂ¢Ã¢â€šÂ¬Ã¢â€žÂ¢ÃƒÆ’Ã†â€™ÃƒÂ¢Ã¢â€šÂ¬Ã‚Â ÃƒÆ’Ã‚Â¢ÃƒÂ¢Ã¢â‚¬Å¡Ã‚Â¬ÃƒÂ¢Ã¢â‚¬Å¾Ã‚Â¢ÃƒÆ’Ã†â€™Ãƒâ€ Ã¢â‚¬â„¢ÃƒÆ’Ã‚Â¢ÃƒÂ¢Ã¢â‚¬Å¡Ã‚Â¬Ãƒâ€¦Ã‚Â¡ÃƒÆ’Ã†â€™ÃƒÂ¢Ã¢â€šÂ¬Ã…Â¡ÃƒÆ’Ã¢â‚¬Å¡Ãƒâ€šÃ‚Â¢ÃƒÆ’Ã†â€™Ãƒâ€ Ã¢â‚¬â„¢ÃƒÆ’Ã¢â‚¬Â ÃƒÂ¢Ã¢â€šÂ¬Ã¢â€žÂ¢ÃƒÆ’Ã†â€™ÃƒÂ¢Ã¢â€šÂ¬Ã…Â¡ÃƒÆ’Ã¢â‚¬Å¡Ãƒâ€šÃ‚Â¢ÃƒÆ’Ã†â€™Ãƒâ€ Ã¢â‚¬â„¢ÃƒÆ’Ã¢â‚¬Å¡Ãƒâ€šÃ‚Â¢ÃƒÆ’Ã†â€™Ãƒâ€šÃ‚Â¢ÃƒÆ’Ã‚Â¢ÃƒÂ¢Ã¢â‚¬Å¡Ã‚Â¬Ãƒâ€¦Ã‚Â¡ÃƒÆ’Ã¢â‚¬Å¡Ãƒâ€šÃ‚Â¬ÃƒÆ’Ã†â€™ÃƒÂ¢Ã¢â€šÂ¬Ã‚Â¦ÃƒÆ’Ã¢â‚¬Å¡Ãƒâ€šÃ‚Â¡ÃƒÆ’Ã†â€™Ãƒâ€ Ã¢â‚¬â„¢ÃƒÆ’Ã‚Â¢ÃƒÂ¢Ã¢â‚¬Å¡Ã‚Â¬Ãƒâ€¦Ã‚Â¡ÃƒÆ’Ã†â€™ÃƒÂ¢Ã¢â€šÂ¬Ã…Â¡ÃƒÆ’Ã¢â‚¬Å¡Ãƒâ€šÃ‚Â¬ÃƒÆ’Ã†â€™Ãƒâ€ Ã¢â‚¬â„¢ÃƒÆ’Ã¢â‚¬Â ÃƒÂ¢Ã¢â€šÂ¬Ã¢â€žÂ¢ÃƒÆ’Ã†â€™Ãƒâ€šÃ‚Â¢ÃƒÆ’Ã‚Â¢ÃƒÂ¢Ã¢â€šÂ¬Ã…Â¡Ãƒâ€šÃ‚Â¬ÃƒÆ’Ã¢â‚¬Å¡Ãƒâ€šÃ‚Â¦ÃƒÆ’Ã†â€™Ãƒâ€ Ã¢â‚¬â„¢ÃƒÆ’Ã¢â‚¬Å¡Ãƒâ€šÃ‚Â¢ÃƒÆ’Ã†â€™Ãƒâ€šÃ‚Â¢ÃƒÆ’Ã‚Â¢ÃƒÂ¢Ã¢â‚¬Å¡Ã‚Â¬Ãƒâ€¦Ã‚Â¡ÃƒÆ’Ã¢â‚¬Å¡Ãƒâ€šÃ‚Â¬ÃƒÆ’Ã†â€™ÃƒÂ¢Ã¢â€šÂ¬Ã‚Â¦ÃƒÆ’Ã‚Â¢ÃƒÂ¢Ã¢â‚¬Å¡Ã‚Â¬Ãƒâ€¦Ã¢â‚¬Å“74 </w:t>
       </w:r>
       <w:proofErr w:type="spellStart"/>
       <w:r>
@@ -8415,7 +8415,7 @@
           <w:sz w:val="28"/>
           <w:szCs w:val="28"/>
         </w:rPr>
-        <w:t>ÃƒÆ’Ã†â€™Ãƒâ€ Ã¢â‚¬â„¢ÃƒÆ’Ã¢â‚¬Â ÃƒÂ¢Ã¢â€šÂ¬Ã¢â€žÂ¢ÃƒÆ’Ã†â€™ÃƒÂ¢Ã¢â€šÂ¬Ã‚Â ÃƒÆ’Ã‚Â¢ÃƒÂ¢Ã¢â‚¬Å¡Ã‚Â¬ÃƒÂ¢Ã¢â‚¬Å¾Ã‚Â¢ÃƒÆ’Ã†â€™Ãƒâ€ Ã¢â‚¬â„¢ÃƒÆ’Ã‚Â¢ÃƒÂ¢Ã¢â‚¬Å¡Ã‚Â¬Ãƒâ€šÃ‚Â ÃƒÆ’Ã†â€™Ãƒâ€šÃ‚Â¢ÃƒÆ’Ã‚Â¢ÃƒÂ¢Ã¢â€šÂ¬Ã…Â¡Ãƒâ€šÃ‚Â¬ÃƒÆ’Ã‚Â¢ÃƒÂ¢Ã¢â€šÂ¬Ã…Â¾Ãƒâ€šÃ‚Â¢ÃƒÆ’Ã†â€™Ãƒâ€ Ã¢â‚¬â„¢ÃƒÆ’Ã¢â‚¬Â ÃƒÂ¢Ã¢â€šÂ¬Ã¢â€žÂ¢ÃƒÆ’Ã†â€™Ãƒâ€šÃ‚Â¢ÃƒÆ’Ã‚Â¢ÃƒÂ¢Ã¢â€šÂ¬Ã…Â¡Ãƒâ€šÃ‚Â¬ÃƒÆ’Ã¢â‚¬Å¡Ãƒâ€šÃ‚Â ÃƒÆ’Ã†â€™Ãƒâ€ Ã¢â‚¬â„¢ÃƒÆ’Ã¢â‚¬Å¡Ãƒâ€šÃ‚Â¢ÃƒÆ’Ã†â€™Ãƒâ€šÃ‚Â¢ÃƒÆ’Ã‚Â¢ÃƒÂ¢Ã¢â‚¬Å¡Ã‚Â¬Ãƒâ€¦Ã‚Â¡ÃƒÆ’Ã¢â‚¬Å¡Ãƒâ€šÃ‚Â¬ÃƒÆ’Ã†â€™Ãƒâ€šÃ‚Â¢ÃƒÆ’Ã‚Â¢ÃƒÂ¢Ã¢â‚¬Å¡Ã‚Â¬Ãƒâ€¦Ã‚Â¾ÃƒÆ’Ã¢â‚¬Å¡Ãƒâ€šÃ‚Â¢ÃƒÆ’Ã†â€™Ãƒâ€ Ã¢â‚¬â„¢ÃƒÆ’Ã¢â‚¬Â ÃƒÂ¢Ã¢â€šÂ¬Ã¢â€žÂ¢ÃƒÆ’Ã†â€™ÃƒÂ¢Ã¢â€šÂ¬Ã‚Â ÃƒÆ’Ã‚Â¢ÃƒÂ¢Ã¢â‚¬Å¡Ã‚Â¬ÃƒÂ¢Ã¢â‚¬Å¾Ã‚Â¢ÃƒÆ’Ã†â€™Ãƒâ€ Ã¢â‚¬â„¢ÃƒÆ’Ã¢â‚¬Å¡Ãƒâ€šÃ‚Â¢ÃƒÆ’Ã†â€™Ãƒâ€šÃ‚Â¢ÃƒÆ’Ã‚Â¢ÃƒÂ¢Ã¢â‚¬Å¡Ã‚Â¬Ãƒâ€¦Ã‚Â¡ÃƒÆ’Ã¢â‚¬Å¡Ãƒâ€šÃ‚Â¬ÃƒÆ’Ã†â€™ÃƒÂ¢Ã¢â€šÂ¬Ã…Â¡ÃƒÆ’Ã¢â‚¬Å¡Ãƒâ€šÃ‚Â¦ÃƒÆ’Ã†â€™Ãƒâ€ Ã¢â‚¬â„¢ÃƒÆ’Ã¢â‚¬Â ÃƒÂ¢Ã¢â€šÂ¬Ã¢â€žÂ¢ÃƒÆ’Ã†â€™Ãƒâ€šÃ‚Â¢ÃƒÆ’Ã‚Â¢ÃƒÂ¢Ã¢â€šÂ¬Ã…Â¡Ãƒâ€šÃ‚Â¬ÃƒÆ’Ã¢â‚¬Â¦Ãƒâ€šÃ‚Â¡ÃƒÆ’Ã†â€™Ãƒâ€ Ã¢â‚¬â„¢ÃƒÆ’Ã‚Â¢ÃƒÂ¢Ã¢â‚¬Å¡Ã‚Â¬Ãƒâ€¦Ã‚Â¡ÃƒÆ’Ã†â€™ÃƒÂ¢Ã¢â€šÂ¬Ã…Â¡ÃƒÆ’Ã¢â‚¬Å¡Ãƒâ€šÃ‚Â½ÃƒÆ’Ã†â€™Ãƒâ€ Ã¢â‚¬â„¢ÃƒÆ’Ã¢â‚¬Â ÃƒÂ¢Ã¢â€šÂ¬Ã¢â€žÂ¢ÃƒÆ’Ã†â€™ÃƒÂ¢Ã¢â€šÂ¬Ã‚Â ÃƒÆ’Ã‚Â¢ÃƒÂ¢Ã¢â‚¬Å¡Ã‚Â¬ÃƒÂ¢Ã¢â‚¬Å¾Ã‚Â¢ÃƒÆ’Ã†â€™Ãƒâ€ Ã¢â‚¬â„¢ÃƒÆ’Ã‚Â¢ÃƒÂ¢Ã¢â‚¬Å¡Ã‚Â¬Ãƒâ€šÃ‚Â ÃƒÆ’Ã†â€™Ãƒâ€šÃ‚Â¢ÃƒÆ’Ã‚Â¢ÃƒÂ¢Ã¢â€šÂ¬Ã…Â¡Ãƒâ€šÃ‚Â¬ÃƒÆ’Ã‚Â¢ÃƒÂ¢Ã¢â€šÂ¬Ã…Â¾Ãƒâ€šÃ‚Â¢ÃƒÆ’Ã†â€™Ãƒâ€ Ã¢â‚¬â„¢ÃƒÆ’Ã¢â‚¬Â ÃƒÂ¢Ã¢â€šÂ¬Ã¢â€žÂ¢ÃƒÆ’Ã†â€™ÃƒÂ¢Ã¢â€šÂ¬Ã…Â¡ÃƒÆ’Ã¢â‚¬Å¡Ãƒâ€šÃ‚Â¢ÃƒÆ’Ã†â€™Ãƒâ€ Ã¢â‚¬â„¢ÃƒÆ’Ã¢â‚¬Å¡Ãƒâ€šÃ‚Â¢ÃƒÆ’Ã†â€™Ãƒâ€šÃ‚Â¢ÃƒÆ’Ã‚Â¢ÃƒÂ¢Ã¢â€šÂ¬Ã…Â¡Ãƒâ€šÃ‚Â¬ÃƒÆ’Ã¢â‚¬Â¦Ãƒâ€šÃ‚Â¡ÃƒÆ’Ã†â€™ÃƒÂ¢Ã¢â€šÂ¬Ã…Â¡ÃƒÆ’Ã¢â‚¬Å¡Ãƒâ€šÃ‚Â¬ÃƒÆ’Ã†â€™Ãƒâ€ Ã¢â‚¬â„¢ÃƒÆ’Ã‚Â¢ÃƒÂ¢Ã¢â‚¬Å¡Ã‚Â¬Ãƒâ€šÃ‚Â¦ÃƒÆ’Ã†â€™ÃƒÂ¢Ã¢â€šÂ¬Ã…Â¡ÃƒÆ’Ã¢â‚¬Å¡Ãƒâ€šÃ‚Â¡ÃƒÆ’Ã†â€™Ãƒâ€ Ã¢â‚¬â„¢ÃƒÆ’Ã¢â‚¬Â ÃƒÂ¢Ã¢â€šÂ¬Ã¢â€žÂ¢ÃƒÆ’Ã†â€™ÃƒÂ¢Ã¢â€šÂ¬Ã‚Â ÃƒÆ’Ã‚Â¢ÃƒÂ¢Ã¢â‚¬Å¡Ã‚Â¬ÃƒÂ¢Ã¢â‚¬Å¾Ã‚Â¢ÃƒÆ’Ã†â€™Ãƒâ€ Ã¢â‚¬â„¢ÃƒÆ’Ã¢â‚¬Å¡Ãƒâ€šÃ‚Â¢ÃƒÆ’Ã†â€™Ãƒâ€šÃ‚Â¢ÃƒÆ’Ã‚Â¢ÃƒÂ¢Ã¢â‚¬Å¡Ã‚Â¬Ãƒâ€¦Ã‚Â¡ÃƒÆ’Ã¢â‚¬Å¡Ãƒâ€šÃ‚Â¬ÃƒÆ’Ã†â€™ÃƒÂ¢Ã¢â€šÂ¬Ã‚Â¦ÃƒÆ’Ã¢â‚¬Å¡Ãƒâ€šÃ‚Â¡ÃƒÆ’Ã†â€™Ãƒâ€ Ã¢â‚¬â„¢ÃƒÆ’Ã¢â‚¬Â ÃƒÂ¢Ã¢â€šÂ¬Ã¢â€žÂ¢ÃƒÆ’Ã†â€™Ãƒâ€šÃ‚Â¢ÃƒÆ’Ã‚Â¢ÃƒÂ¢Ã¢â€šÂ¬Ã…Â¡Ãƒâ€šÃ‚Â¬ÃƒÆ’Ã¢â‚¬Â¦Ãƒâ€šÃ‚Â¡ÃƒÆ’Ã†â€™Ãƒâ€ Ã¢â‚¬â„¢ÃƒÆ’Ã‚Â¢ÃƒÂ¢Ã¢â‚¬Å¡Ã‚Â¬Ãƒâ€¦Ã‚Â¡ÃƒÆ’Ã†â€™ÃƒÂ¢Ã¢â€šÂ¬Ã…Â¡ÃƒÆ’Ã¢â‚¬Å¡Ãƒâ€šÃ‚Â¼g</w:t>
+        <w:t>ÃƒÆ’Ã†â€™Ãƒâ€ Ã¢â‚¬â„¢ÃƒÆ’Ã¢â‚¬Â ÃƒÂ¢Ã¢â€šÂ¬Ã¢â€žÂ¢ÃƒÆ’Ã†â€™ÃƒÂ¢Ã¢â€šÂ¬Ã‚Â ÃƒÆ’Ã‚Â¢ÃƒÂ¢Ã¢â‚¬Å¡Ã‚Â¬ÃƒÂ¢Ã¢â‚¬Å¾Ã‚Â¢ÃƒÆ’Ã†â€™Ãƒâ€ Ã¢â‚¬â„¢ÃƒÆ’Ã‚Â¢ÃƒÂ¢Ã¢â‚¬Å¡Ã‚Â¬Ãƒâ€šÃ‚Â ÃƒÆ’Ã†â€™Ãƒâ€šÃ‚Â¢ÃƒÆ’Ã‚Â¢ÃƒÂ¢Ã¢â€šÂ¬Ã…Â¡Ãƒâ€šÃ‚Â¬ÃƒÆ’Ã‚Â¢ÃƒÂ¢Ã¢â€šÂ¬Ã…Â¾Ãƒâ€šÃ‚Â¢ÃƒÆ’Ã†â€™Ãƒâ€ Ã¢â‚¬â„¢ÃƒÆ’Ã¢â‚¬Â ÃƒÂ¢Ã¢â€šÂ¬Ã¢â€žÂ¢ÃƒÆ’Ã†â€™Ãƒâ€šÃ‚Â¢ÃƒÆ’Ã‚Â¢ÃƒÂ¢Ã¢â€šÂ¬Ã…Â¡Ãƒâ€šÃ‚Â¬ÃƒÆ’Ã¢â‚¬Å¡Ãƒâ€šÃ‚Â ÃƒÆ’Ã†â€™Ãƒâ€ Ã¢â‚¬â„¢ÃƒÆ’Ã¢â‚¬Å¡Ãƒâ€šÃ‚Â¢ÃƒÆ’Ã†â€™Ãƒâ€šÃ‚Â¢ÃƒÆ’Ã‚Â¢ÃƒÂ¢Ã¢â‚¬Å¡Ã‚Â¬Ãƒâ€¦Ã‚Â¡ÃƒÆ’Ã¢â‚¬Å¡Ãƒâ€šÃ‚Â¬ÃƒÆ’Ã†â€™Ãƒâ€šÃ‚Â¢ÃƒÆ’Ã‚Â¢ÃƒÂ¢Ã¢â‚¬Å¡Ã‚Â¬Ãƒâ€¦Ã‚Â¾ÃƒÆ’Ã¢â‚¬Å¡Ãƒâ€šÃ‚Â¢ÃƒÆ’Ã†â€™Ãƒâ€ Ã¢â‚¬â„¢ÃƒÆ’Ã¢â‚¬Â ÃƒÂ¢Ã¢â€šÂ¬Ã¢â€žÂ¢ÃƒÆ’Ã†â€™ÃƒÂ¢Ã¢â€šÂ¬Ã‚Â ÃƒÆ’Ã‚Â¢ÃƒÂ¢Ã¢â‚¬Å¡Ã‚Â¬ÃƒÂ¢Ã¢â‚¬Å¾Ã‚Â¢ÃƒÆ’Ã†â€™Ãƒâ€ Ã¢â‚¬â„¢ÃƒÆ’Ã¢â‚¬Å¡Ãƒâ€šÃ‚Â¢ÃƒÆ’Ã†â€™Ãƒâ€šÃ‚Â¢ÃƒÆ’Ã‚Â¢ÃƒÂ¢Ã¢â‚¬Å¡Ã‚Â¬Ãƒâ€¦Ã‚Â¡ÃƒÆ’Ã¢â‚¬Å¡Ãƒâ€šÃ‚Â¬ÃƒÆ’Ã†â€™ÃƒÂ¢Ã¢â€šÂ¬Ã…Â¡ÃƒÆ’Ã¢â‚¬Å¡Ãƒâ€šÃ‚Â ÃƒÆ’Ã†â€™Ãƒâ€ Ã¢â‚¬â„¢ÃƒÆ’Ã¢â‚¬Â ÃƒÂ¢Ã¢â€šÂ¬Ã¢â€žÂ¢ÃƒÆ’Ã†â€™ÃƒÂ¢Ã¢â€šÂ¬Ã…Â¡ÃƒÆ’Ã¢â‚¬Å¡Ãƒâ€šÃ‚Â¢ÃƒÆ’Ã†â€™Ãƒâ€ Ã¢â‚¬â„¢ÃƒÆ’Ã¢â‚¬Å¡Ãƒâ€šÃ‚Â¢ÃƒÆ’Ã†â€™Ãƒâ€šÃ‚Â¢ÃƒÆ’Ã‚Â¢ÃƒÂ¢Ã¢â€šÂ¬Ã…Â¡Ãƒâ€šÃ‚Â¬ÃƒÆ’Ã¢â‚¬Â¦Ãƒâ€šÃ‚Â¡ÃƒÆ’Ã†â€™ÃƒÂ¢Ã¢â€šÂ¬Ã…Â¡ÃƒÆ’Ã¢â‚¬Å¡Ãƒâ€šÃ‚Â¬ÃƒÆ’Ã†â€™Ãƒâ€ Ã¢â‚¬â„¢ÃƒÆ’Ã¢â‚¬Å¡Ãƒâ€šÃ‚Â¢ÃƒÆ’Ã†â€™Ãƒâ€šÃ‚Â¢ÃƒÆ’Ã‚Â¢ÃƒÂ¢Ã¢â€šÂ¬Ã…Â¡Ãƒâ€šÃ‚Â¬ÃƒÆ’Ã¢â‚¬Â¦Ãƒâ€šÃ‚Â¾ÃƒÆ’Ã†â€™ÃƒÂ¢Ã¢â€šÂ¬Ã…Â¡ÃƒÆ’Ã¢â‚¬Å¡Ãƒâ€šÃ‚Â¢ÃƒÆ’Ã†â€™Ãƒâ€ Ã¢â‚¬â„¢ÃƒÆ’Ã¢â‚¬Â ÃƒÂ¢Ã¢â€šÂ¬Ã¢â€žÂ¢ÃƒÆ’Ã†â€™ÃƒÂ¢Ã¢â€šÂ¬Ã‚Â ÃƒÆ’Ã‚Â¢ÃƒÂ¢Ã¢â‚¬Å¡Ã‚Â¬ÃƒÂ¢Ã¢â‚¬Å¾Ã‚Â¢ÃƒÆ’Ã†â€™Ãƒâ€ Ã¢â‚¬â„¢ÃƒÆ’Ã‚Â¢ÃƒÂ¢Ã¢â‚¬Å¡Ã‚Â¬Ãƒâ€šÃ‚Â ÃƒÆ’Ã†â€™Ãƒâ€šÃ‚Â¢ÃƒÆ’Ã‚Â¢ÃƒÂ¢Ã¢â€šÂ¬Ã…Â¡Ãƒâ€šÃ‚Â¬ÃƒÆ’Ã‚Â¢ÃƒÂ¢Ã¢â€šÂ¬Ã…Â¾Ãƒâ€šÃ‚Â¢ÃƒÆ’Ã†â€™Ãƒâ€ Ã¢â‚¬â„¢ÃƒÆ’Ã¢â‚¬Â ÃƒÂ¢Ã¢â€šÂ¬Ã¢â€žÂ¢ÃƒÆ’Ã†â€™ÃƒÂ¢Ã¢â€šÂ¬Ã…Â¡ÃƒÆ’Ã¢â‚¬Å¡Ãƒâ€šÃ‚Â¢ÃƒÆ’Ã†â€™Ãƒâ€ Ã¢â‚¬â„¢ÃƒÆ’Ã¢â‚¬Å¡Ãƒâ€šÃ‚Â¢ÃƒÆ’Ã†â€™Ãƒâ€šÃ‚Â¢ÃƒÆ’Ã‚Â¢ÃƒÂ¢Ã¢â€šÂ¬Ã…Â¡Ãƒâ€šÃ‚Â¬ÃƒÆ’Ã¢â‚¬Â¦Ãƒâ€šÃ‚Â¡ÃƒÆ’Ã†â€™ÃƒÂ¢Ã¢â€šÂ¬Ã…Â¡ÃƒÆ’Ã¢â‚¬Å¡Ãƒâ€šÃ‚Â¬ÃƒÆ’Ã†â€™Ãƒâ€ Ã¢â‚¬â„¢ÃƒÆ’Ã‚Â¢ÃƒÂ¢Ã¢â‚¬Å¡Ã‚Â¬Ãƒâ€¦Ã‚Â¡ÃƒÆ’Ã†â€™ÃƒÂ¢Ã¢â€šÂ¬Ã…Â¡ÃƒÆ’Ã¢â‚¬Å¡Ãƒâ€šÃ‚Â¦ÃƒÆ’Ã†â€™Ãƒâ€ Ã¢â‚¬â„¢ÃƒÆ’Ã¢â‚¬Â ÃƒÂ¢Ã¢â€šÂ¬Ã¢â€žÂ¢ÃƒÆ’Ã†â€™ÃƒÂ¢Ã¢â€šÂ¬Ã‚Â ÃƒÆ’Ã‚Â¢ÃƒÂ¢Ã¢â‚¬Å¡Ã‚Â¬ÃƒÂ¢Ã¢â‚¬Å¾Ã‚Â¢ÃƒÆ’Ã†â€™Ãƒâ€ Ã¢â‚¬â„¢ÃƒÆ’Ã¢â‚¬Å¡Ãƒâ€šÃ‚Â¢ÃƒÆ’Ã†â€™Ãƒâ€šÃ‚Â¢ÃƒÆ’Ã‚Â¢ÃƒÂ¢Ã¢â‚¬Å¡Ã‚Â¬Ãƒâ€¦Ã‚Â¡ÃƒÆ’Ã¢â‚¬Å¡Ãƒâ€šÃ‚Â¬ÃƒÆ’Ã†â€™ÃƒÂ¢Ã¢â€šÂ¬Ã‚Â¦ÃƒÆ’Ã¢â‚¬Å¡Ãƒâ€šÃ‚Â¡ÃƒÆ’Ã†â€™Ãƒâ€ Ã¢â‚¬â„¢ÃƒÆ’Ã¢â‚¬Â ÃƒÂ¢Ã¢â€šÂ¬Ã¢â€žÂ¢ÃƒÆ’Ã†â€™Ãƒâ€šÃ‚Â¢ÃƒÆ’Ã‚Â¢ÃƒÂ¢Ã¢â€šÂ¬Ã…Â¡Ãƒâ€šÃ‚Â¬ÃƒÆ’Ã¢â‚¬Â¦Ãƒâ€šÃ‚Â¡ÃƒÆ’Ã†â€™Ãƒâ€ Ã¢â‚¬â„¢ÃƒÆ’Ã‚Â¢ÃƒÂ¢Ã¢â‚¬Å¡Ã‚Â¬Ãƒâ€¦Ã‚Â¡ÃƒÆ’Ã†â€™ÃƒÂ¢Ã¢â€šÂ¬Ã…Â¡ÃƒÆ’Ã¢â‚¬Å¡Ãƒâ€šÃ‚Â½ÃƒÆ’Ã†â€™Ãƒâ€ Ã¢â‚¬â„¢ÃƒÆ’Ã¢â‚¬Â ÃƒÂ¢Ã¢â€šÂ¬Ã¢â€žÂ¢ÃƒÆ’Ã†â€™ÃƒÂ¢Ã¢â€šÂ¬Ã‚Â ÃƒÆ’Ã‚Â¢ÃƒÂ¢Ã¢â‚¬Å¡Ã‚Â¬ÃƒÂ¢Ã¢â‚¬Å¾Ã‚Â¢ÃƒÆ’Ã†â€™Ãƒâ€ Ã¢â‚¬â„¢ÃƒÆ’Ã‚Â¢ÃƒÂ¢Ã¢â‚¬Å¡Ã‚Â¬Ãƒâ€šÃ‚Â ÃƒÆ’Ã†â€™Ãƒâ€šÃ‚Â¢ÃƒÆ’Ã‚Â¢ÃƒÂ¢Ã¢â€šÂ¬Ã…Â¡Ãƒâ€šÃ‚Â¬ÃƒÆ’Ã‚Â¢ÃƒÂ¢Ã¢â€šÂ¬Ã…Â¾Ãƒâ€šÃ‚Â¢ÃƒÆ’Ã†â€™Ãƒâ€ Ã¢â‚¬â„¢ÃƒÆ’Ã¢â‚¬Â ÃƒÂ¢Ã¢â€šÂ¬Ã¢â€žÂ¢ÃƒÆ’Ã†â€™Ãƒâ€šÃ‚Â¢ÃƒÆ’Ã‚Â¢ÃƒÂ¢Ã¢â€šÂ¬Ã…Â¡Ãƒâ€šÃ‚Â¬ÃƒÆ’Ã¢â‚¬Å¡Ãƒâ€šÃ‚Â ÃƒÆ’Ã†â€™Ãƒâ€ Ã¢â‚¬â„¢ÃƒÆ’Ã¢â‚¬Å¡Ãƒâ€šÃ‚Â¢ÃƒÆ’Ã†â€™Ãƒâ€šÃ‚Â¢ÃƒÆ’Ã‚Â¢ÃƒÂ¢Ã¢â‚¬Å¡Ã‚Â¬Ãƒâ€¦Ã‚Â¡ÃƒÆ’Ã¢â‚¬Å¡Ãƒâ€šÃ‚Â¬ÃƒÆ’Ã†â€™Ãƒâ€šÃ‚Â¢ÃƒÆ’Ã‚Â¢ÃƒÂ¢Ã¢â‚¬Å¡Ã‚Â¬Ãƒâ€¦Ã‚Â¾ÃƒÆ’Ã¢â‚¬Å¡Ãƒâ€šÃ‚Â¢ÃƒÆ’Ã†â€™Ãƒâ€ Ã¢â‚¬â„¢ÃƒÆ’Ã¢â‚¬Â ÃƒÂ¢Ã¢â€šÂ¬Ã¢â€žÂ¢ÃƒÆ’Ã†â€™ÃƒÂ¢Ã¢â€šÂ¬Ã‚Â ÃƒÆ’Ã‚Â¢ÃƒÂ¢Ã¢â‚¬Å¡Ã‚Â¬ÃƒÂ¢Ã¢â‚¬Å¾Ã‚Â¢ÃƒÆ’Ã†â€™Ãƒâ€ Ã¢â‚¬â„¢ÃƒÆ’Ã‚Â¢ÃƒÂ¢Ã¢â‚¬Å¡Ã‚Â¬Ãƒâ€¦Ã‚Â¡ÃƒÆ’Ã†â€™ÃƒÂ¢Ã¢â€šÂ¬Ã…Â¡ÃƒÆ’Ã¢â‚¬Å¡Ãƒâ€šÃ‚Â¢ÃƒÆ’Ã†â€™Ãƒâ€ Ã¢â‚¬â„¢ÃƒÆ’Ã¢â‚¬Â ÃƒÂ¢Ã¢â€šÂ¬Ã¢â€žÂ¢ÃƒÆ’Ã†â€™ÃƒÂ¢Ã¢â€šÂ¬Ã…Â¡ÃƒÆ’Ã¢â‚¬Å¡Ãƒâ€šÃ‚Â¢ÃƒÆ’Ã†â€™Ãƒâ€ Ã¢â‚¬â„¢ÃƒÆ’Ã¢â‚¬Å¡Ãƒâ€šÃ‚Â¢ÃƒÆ’Ã†â€™Ãƒâ€šÃ‚Â¢ÃƒÆ’Ã‚Â¢ÃƒÂ¢Ã¢â‚¬Å¡Ã‚Â¬Ãƒâ€¦Ã‚Â¡ÃƒÆ’Ã¢â‚¬Å¡Ãƒâ€šÃ‚Â¬ÃƒÆ’Ã†â€™ÃƒÂ¢Ã¢â€šÂ¬Ã‚Â¦ÃƒÆ’Ã¢â‚¬Å¡Ãƒâ€šÃ‚Â¡ÃƒÆ’Ã†â€™Ãƒâ€ Ã¢â‚¬â„¢ÃƒÆ’Ã‚Â¢ÃƒÂ¢Ã¢â‚¬Å¡Ã‚Â¬Ãƒâ€¦Ã‚Â¡ÃƒÆ’Ã†â€™ÃƒÂ¢Ã¢â€šÂ¬Ã…Â¡ÃƒÆ’Ã¢â‚¬Å¡Ãƒâ€šÃ‚Â¬ÃƒÆ’Ã†â€™Ãƒâ€ Ã¢â‚¬â„¢ÃƒÆ’Ã¢â‚¬Â ÃƒÂ¢Ã¢â€šÂ¬Ã¢â€žÂ¢ÃƒÆ’Ã†â€™Ãƒâ€šÃ‚Â¢ÃƒÆ’Ã‚Â¢ÃƒÂ¢Ã¢â€šÂ¬Ã…Â¡Ãƒâ€šÃ‚Â¬ÃƒÆ’Ã¢â‚¬Å¡Ãƒâ€šÃ‚Â¦ÃƒÆ’Ã†â€™Ãƒâ€ Ã¢â‚¬â„¢ÃƒÆ’Ã‚Â¢ÃƒÂ¢Ã¢â‚¬Å¡Ã‚Â¬Ãƒâ€¦Ã‚Â¡ÃƒÆ’Ã†â€™ÃƒÂ¢Ã¢â€šÂ¬Ã…Â¡ÃƒÆ’Ã¢â‚¬Å¡Ãƒâ€šÃ‚Â¡ÃƒÆ’Ã†â€™Ãƒâ€ Ã¢â‚¬â„¢ÃƒÆ’Ã¢â‚¬Â ÃƒÂ¢Ã¢â€šÂ¬Ã¢â€žÂ¢ÃƒÆ’Ã†â€™ÃƒÂ¢Ã¢â€šÂ¬Ã‚Â ÃƒÆ’Ã‚Â¢ÃƒÂ¢Ã¢â‚¬Å¡Ã‚Â¬ÃƒÂ¢Ã¢â‚¬Å¾Ã‚Â¢ÃƒÆ’Ã†â€™Ãƒâ€ Ã¢â‚¬â„¢ÃƒÆ’Ã‚Â¢ÃƒÂ¢Ã¢â‚¬Å¡Ã‚Â¬Ãƒâ€šÃ‚Â ÃƒÆ’Ã†â€™Ãƒâ€šÃ‚Â¢ÃƒÆ’Ã‚Â¢ÃƒÂ¢Ã¢â€šÂ¬Ã…Â¡Ãƒâ€šÃ‚Â¬ÃƒÆ’Ã‚Â¢ÃƒÂ¢Ã¢â€šÂ¬Ã…Â¾Ãƒâ€šÃ‚Â¢ÃƒÆ’Ã†â€™Ãƒâ€ Ã¢â‚¬â„¢ÃƒÆ’Ã¢â‚¬Â ÃƒÂ¢Ã¢â€šÂ¬Ã¢â€žÂ¢ÃƒÆ’Ã†â€™ÃƒÂ¢Ã¢â€šÂ¬Ã…Â¡ÃƒÆ’Ã¢â‚¬Å¡Ãƒâ€šÃ‚Â¢ÃƒÆ’Ã†â€™Ãƒâ€ Ã¢â‚¬â„¢ÃƒÆ’Ã¢â‚¬Å¡Ãƒâ€šÃ‚Â¢ÃƒÆ’Ã†â€™Ãƒâ€šÃ‚Â¢ÃƒÆ’Ã‚Â¢ÃƒÂ¢Ã¢â€šÂ¬Ã…Â¡Ãƒâ€šÃ‚Â¬ÃƒÆ’Ã¢â‚¬Â¦Ãƒâ€šÃ‚Â¡ÃƒÆ’Ã†â€™ÃƒÂ¢Ã¢â€šÂ¬Ã…Â¡ÃƒÆ’Ã¢â‚¬Å¡Ãƒâ€šÃ‚Â¬ÃƒÆ’Ã†â€™Ãƒâ€ Ã¢â‚¬â„¢ÃƒÆ’Ã‚Â¢ÃƒÂ¢Ã¢â‚¬Å¡Ã‚Â¬Ãƒâ€šÃ‚Â¦ÃƒÆ’Ã†â€™ÃƒÂ¢Ã¢â€šÂ¬Ã…Â¡ÃƒÆ’Ã¢â‚¬Å¡Ãƒâ€šÃ‚Â¡ÃƒÆ’Ã†â€™Ãƒâ€ Ã¢â‚¬â„¢ÃƒÆ’Ã¢â‚¬Â ÃƒÂ¢Ã¢â€šÂ¬Ã¢â€žÂ¢ÃƒÆ’Ã†â€™ÃƒÂ¢Ã¢â€šÂ¬Ã‚Â ÃƒÆ’Ã‚Â¢ÃƒÂ¢Ã¢â‚¬Å¡Ã‚Â¬ÃƒÂ¢Ã¢â‚¬Å¾Ã‚Â¢ÃƒÆ’Ã†â€™Ãƒâ€ Ã¢â‚¬â„¢ÃƒÆ’Ã¢â‚¬Å¡Ãƒâ€šÃ‚Â¢ÃƒÆ’Ã†â€™Ãƒâ€šÃ‚Â¢ÃƒÆ’Ã‚Â¢ÃƒÂ¢Ã¢â‚¬Å¡Ã‚Â¬Ãƒâ€¦Ã‚Â¡ÃƒÆ’Ã¢â‚¬Å¡Ãƒâ€šÃ‚Â¬ÃƒÆ’Ã†â€™ÃƒÂ¢Ã¢â€šÂ¬Ã‚Â¦ÃƒÆ’Ã¢â‚¬Å¡Ãƒâ€šÃ‚Â¡ÃƒÆ’Ã†â€™Ãƒâ€ Ã¢â‚¬â„¢ÃƒÆ’Ã¢â‚¬Â ÃƒÂ¢Ã¢â€šÂ¬Ã¢â€žÂ¢ÃƒÆ’Ã†â€™Ãƒâ€šÃ‚Â¢ÃƒÆ’Ã‚Â¢ÃƒÂ¢Ã¢â€šÂ¬Ã…Â¡Ãƒâ€šÃ‚Â¬ÃƒÆ’Ã¢â‚¬Â¦Ãƒâ€šÃ‚Â¡ÃƒÆ’Ã†â€™Ãƒâ€ Ã¢â‚¬â„¢ÃƒÆ’Ã‚Â¢ÃƒÂ¢Ã¢â‚¬Å¡Ã‚Â¬Ãƒâ€¦Ã‚Â¡ÃƒÆ’Ã†â€™ÃƒÂ¢Ã¢â€šÂ¬Ã…Â¡ÃƒÆ’Ã¢â‚¬Å¡Ãƒâ€šÃ‚Â¼g</w:t>
       </w:r>
       <w:proofErr w:type="spellEnd"/>
       <w:r>
@@ -8551,7 +8551,7 @@
           <w:szCs w:val="28"/>
         </w:rPr>
         <w:lastRenderedPageBreak/>
-        <w:t>The bar chart illustrates the changes in nitrite nitrogen (NOÃƒÆ’Ã†â€™Ãƒâ€ Ã¢â‚¬â„¢ÃƒÆ’Ã¢â‚¬Â ÃƒÂ¢Ã¢â€šÂ¬Ã¢â€žÂ¢ÃƒÆ’Ã†â€™ÃƒÂ¢Ã¢â€šÂ¬Ã‚Â ÃƒÆ’Ã‚Â¢ÃƒÂ¢Ã¢â‚¬Å¡Ã‚Â¬ÃƒÂ¢Ã¢â‚¬Å¾Ã‚Â¢ÃƒÆ’Ã†â€™Ãƒâ€ Ã¢â‚¬â„¢ÃƒÆ’Ã‚Â¢ÃƒÂ¢Ã¢â‚¬Å¡Ã‚Â¬Ãƒâ€šÃ‚Â ÃƒÆ’Ã†â€™Ãƒâ€šÃ‚Â¢ÃƒÆ’Ã‚Â¢ÃƒÂ¢Ã¢â€šÂ¬Ã…Â¡Ãƒâ€šÃ‚Â¬ÃƒÆ’Ã‚Â¢ÃƒÂ¢Ã¢â€šÂ¬Ã…Â¾Ãƒâ€šÃ‚Â¢ÃƒÆ’Ã†â€™Ãƒâ€ Ã¢â‚¬â„¢ÃƒÆ’Ã¢â‚¬Â ÃƒÂ¢Ã¢â€šÂ¬Ã¢â€žÂ¢ÃƒÆ’Ã†â€™Ãƒâ€šÃ‚Â¢ÃƒÆ’Ã‚Â¢ÃƒÂ¢Ã¢â€šÂ¬Ã…Â¡Ãƒâ€šÃ‚Â¬ÃƒÆ’Ã¢â‚¬Å¡Ãƒâ€šÃ‚Â ÃƒÆ’Ã†â€™Ãƒâ€ Ã¢â‚¬â„¢ÃƒÆ’Ã¢â‚¬Å¡Ãƒâ€šÃ‚Â¢ÃƒÆ’Ã†â€™Ãƒâ€šÃ‚Â¢ÃƒÆ’Ã‚Â¢ÃƒÂ¢Ã¢â‚¬Å¡Ã‚Â¬Ãƒâ€¦Ã‚Â¡ÃƒÆ’Ã¢â‚¬Å¡Ãƒâ€šÃ‚Â¬ÃƒÆ’Ã†â€™Ãƒâ€šÃ‚Â¢ÃƒÆ’Ã‚Â¢ÃƒÂ¢Ã¢â‚¬Å¡Ã‚Â¬Ãƒâ€¦Ã‚Â¾ÃƒÆ’Ã¢â‚¬Å¡Ãƒâ€šÃ‚Â¢ÃƒÆ’Ã†â€™Ãƒâ€ Ã¢â‚¬â„¢ÃƒÆ’Ã¢â‚¬Â ÃƒÂ¢Ã¢â€šÂ¬Ã¢â€žÂ¢ÃƒÆ’Ã†â€™ÃƒÂ¢Ã¢â€šÂ¬Ã‚Â ÃƒÆ’Ã‚Â¢ÃƒÂ¢Ã¢â‚¬Å¡Ã‚Â¬ÃƒÂ¢Ã¢â‚¬Å¾Ã‚Â¢ÃƒÆ’Ã†â€™Ãƒâ€ Ã¢â‚¬â„¢ÃƒÆ’Ã¢â‚¬Å¡Ãƒâ€šÃ‚Â¢ÃƒÆ’Ã†â€™Ãƒâ€šÃ‚Â¢ÃƒÆ’Ã‚Â¢ÃƒÂ¢Ã¢â‚¬Å¡Ã‚Â¬Ãƒâ€¦Ã‚Â¡ÃƒÆ’Ã¢â‚¬Å¡Ãƒâ€šÃ‚Â¬ÃƒÆ’Ã†â€™ÃƒÂ¢Ã¢â€šÂ¬Ã‚Â¦ÃƒÆ’Ã¢â‚¬Å¡Ãƒâ€šÃ‚Â¡ÃƒÆ’Ã†â€™Ãƒâ€ Ã¢â‚¬â„¢ÃƒÆ’Ã¢â‚¬Â ÃƒÂ¢Ã¢â€šÂ¬Ã¢â€žÂ¢ÃƒÆ’Ã†â€™Ãƒâ€šÃ‚Â¢ÃƒÆ’Ã‚Â¢ÃƒÂ¢Ã¢â€šÂ¬Ã…Â¡Ãƒâ€šÃ‚Â¬ÃƒÆ’Ã¢â‚¬Â¦Ãƒâ€šÃ‚Â¡ÃƒÆ’Ã†â€™Ãƒâ€ Ã¢â‚¬â„¢ÃƒÆ’Ã‚Â¢ÃƒÂ¢Ã¢â‚¬Å¡Ã‚Â¬Ãƒâ€¦Ã‚Â¡ÃƒÆ’Ã†â€™ÃƒÂ¢Ã¢â€šÂ¬Ã…Â¡ÃƒÆ’Ã¢â‚¬Å¡Ãƒâ€šÃ‚Â¢ÃƒÆ’Ã†â€™Ãƒâ€ Ã¢â‚¬â„¢ÃƒÆ’Ã¢â‚¬Â ÃƒÂ¢Ã¢â€šÂ¬Ã¢â€žÂ¢ÃƒÆ’Ã†â€™ÃƒÂ¢Ã¢â€šÂ¬Ã‚Â ÃƒÆ’Ã‚Â¢ÃƒÂ¢Ã¢â‚¬Å¡Ã‚Â¬ÃƒÂ¢Ã¢â‚¬Å¾Ã‚Â¢ÃƒÆ’Ã†â€™Ãƒâ€ Ã¢â‚¬â„¢ÃƒÆ’Ã‚Â¢ÃƒÂ¢Ã¢â‚¬Å¡Ã‚Â¬Ãƒâ€šÃ‚Â ÃƒÆ’Ã†â€™Ãƒâ€šÃ‚Â¢ÃƒÆ’Ã‚Â¢ÃƒÂ¢Ã¢â€šÂ¬Ã…Â¡Ãƒâ€šÃ‚Â¬ÃƒÆ’Ã‚Â¢ÃƒÂ¢Ã¢â€šÂ¬Ã…Â¾Ãƒâ€šÃ‚Â¢ÃƒÆ’Ã†â€™Ãƒâ€ Ã¢â‚¬â„¢ÃƒÆ’Ã¢â‚¬Â ÃƒÂ¢Ã¢â€šÂ¬Ã¢â€žÂ¢ÃƒÆ’Ã†â€™Ãƒâ€šÃ‚Â¢ÃƒÆ’Ã‚Â¢ÃƒÂ¢Ã¢â€šÂ¬Ã…Â¡Ãƒâ€šÃ‚Â¬ÃƒÆ’Ã¢â‚¬Â¦Ãƒâ€šÃ‚Â¡ÃƒÆ’Ã†â€™Ãƒâ€ Ã¢â‚¬â„¢ÃƒÆ’Ã‚Â¢ÃƒÂ¢Ã¢â‚¬Å¡Ã‚Â¬Ãƒâ€¦Ã‚Â¡ÃƒÆ’Ã†â€™ÃƒÂ¢Ã¢â€šÂ¬Ã…Â¡ÃƒÆ’Ã¢â‚¬Å¡Ãƒâ€šÃ‚Â¢ÃƒÆ’Ã†â€™Ãƒâ€ Ã¢â‚¬â„¢ÃƒÆ’Ã¢â‚¬Â ÃƒÂ¢Ã¢â€šÂ¬Ã¢â€žÂ¢ÃƒÆ’Ã†â€™ÃƒÂ¢Ã¢â€šÂ¬Ã‚Â ÃƒÆ’Ã‚Â¢ÃƒÂ¢Ã¢â‚¬Å¡Ã‚Â¬ÃƒÂ¢Ã¢â‚¬Å¾Ã‚Â¢ÃƒÆ’Ã†â€™Ãƒâ€ Ã¢â‚¬â„¢ÃƒÆ’Ã‚Â¢ÃƒÂ¢Ã¢â‚¬Å¡Ã‚Â¬Ãƒâ€¦Ã‚Â¡ÃƒÆ’Ã†â€™ÃƒÂ¢Ã¢â€šÂ¬Ã…Â¡ÃƒÆ’Ã¢â‚¬Å¡Ãƒâ€šÃ‚Â¢ÃƒÆ’Ã†â€™Ãƒâ€ Ã¢â‚¬â„¢ÃƒÆ’Ã¢â‚¬Â ÃƒÂ¢Ã¢â€šÂ¬Ã¢â€žÂ¢ÃƒÆ’Ã†â€™ÃƒÂ¢Ã¢â€šÂ¬Ã…Â¡ÃƒÆ’Ã¢â‚¬Å¡Ãƒâ€šÃ‚Â¢ÃƒÆ’Ã†â€™Ãƒâ€ Ã¢â‚¬â„¢ÃƒÆ’Ã¢â‚¬Å¡Ãƒâ€šÃ‚Â¢ÃƒÆ’Ã†â€™Ãƒâ€šÃ‚Â¢ÃƒÆ’Ã‚Â¢ÃƒÂ¢Ã¢â€šÂ¬Ã…Â¡Ãƒâ€šÃ‚Â¬ÃƒÆ’Ã¢â‚¬Â¦Ãƒâ€šÃ‚Â¡ÃƒÆ’Ã†â€™ÃƒÂ¢Ã¢â€šÂ¬Ã…Â¡ÃƒÆ’Ã¢â‚¬Å¡Ãƒâ€šÃ‚Â¬ÃƒÆ’Ã†â€™Ãƒâ€ Ã¢â‚¬â„¢ÃƒÆ’Ã‚Â¢ÃƒÂ¢Ã¢â‚¬Å¡Ã‚Â¬Ãƒâ€šÃ‚Â¦ÃƒÆ’Ã†â€™ÃƒÂ¢Ã¢â€šÂ¬Ã…Â¡ÃƒÆ’Ã¢â‚¬Å¡Ãƒâ€šÃ‚Â¡ÃƒÆ’Ã†â€™Ãƒâ€ Ã¢â‚¬â„¢ÃƒÆ’Ã¢â‚¬Â ÃƒÂ¢Ã¢â€šÂ¬Ã¢â€žÂ¢ÃƒÆ’Ã†â€™Ãƒâ€šÃ‚Â¢ÃƒÆ’Ã‚Â¢ÃƒÂ¢Ã¢â€šÂ¬Ã…Â¡Ãƒâ€šÃ‚Â¬ÃƒÆ’Ã¢â‚¬Â¦Ãƒâ€šÃ‚Â¡ÃƒÆ’Ã†â€™Ãƒâ€ Ã¢â‚¬â„¢ÃƒÆ’Ã‚Â¢ÃƒÂ¢Ã¢â‚¬Å¡Ã‚Â¬Ãƒâ€¦Ã‚Â¡ÃƒÆ’Ã†â€™ÃƒÂ¢Ã¢â€šÂ¬Ã…Â¡ÃƒÆ’Ã¢â‚¬Å¡Ãƒâ€šÃ‚Â¬ÃƒÆ’Ã†â€™Ãƒâ€ Ã¢â‚¬â„¢ÃƒÆ’Ã¢â‚¬Â ÃƒÂ¢Ã¢â€šÂ¬Ã¢â€žÂ¢ÃƒÆ’Ã†â€™ÃƒÂ¢Ã¢â€šÂ¬Ã‚Â ÃƒÆ’Ã‚Â¢ÃƒÂ¢Ã¢â‚¬Å¡Ã‚Â¬ÃƒÂ¢Ã¢â‚¬Å¾Ã‚Â¢ÃƒÆ’Ã†â€™Ãƒâ€ Ã¢â‚¬â„¢ÃƒÆ’Ã¢â‚¬Å¡Ãƒâ€šÃ‚Â¢ÃƒÆ’Ã†â€™Ãƒâ€šÃ‚Â¢ÃƒÆ’Ã‚Â¢ÃƒÂ¢Ã¢â‚¬Å¡Ã‚Â¬Ãƒâ€¦Ã‚Â¡ÃƒÆ’Ã¢â‚¬Å¡Ãƒâ€šÃ‚Â¬ÃƒÆ’Ã†â€™ÃƒÂ¢Ã¢â€šÂ¬Ã…Â¡ÃƒÆ’Ã¢â‚¬Å¡Ãƒâ€šÃ‚Â¦ÃƒÆ’Ã†â€™Ãƒâ€ Ã¢â‚¬â„¢ÃƒÆ’Ã¢â‚¬Â ÃƒÂ¢Ã¢â€šÂ¬Ã¢â€žÂ¢ÃƒÆ’Ã†â€™Ãƒâ€šÃ‚Â¢ÃƒÆ’Ã‚Â¢ÃƒÂ¢Ã¢â€šÂ¬Ã…Â¡Ãƒâ€šÃ‚Â¬ÃƒÆ’Ã¢â‚¬Â¦Ãƒâ€šÃ‚Â¡ÃƒÆ’Ã†â€™Ãƒâ€ Ã¢â‚¬â„¢ÃƒÆ’Ã‚Â¢ÃƒÂ¢Ã¢â‚¬Å¡Ã‚Â¬Ãƒâ€¦Ã‚Â¡ÃƒÆ’Ã†â€™ÃƒÂ¢Ã¢â€šÂ¬Ã…Â¡ÃƒÆ’Ã¢â‚¬Å¡Ãƒâ€šÃ‚Â¡ÃƒÆ’Ã†â€™Ãƒâ€ Ã¢â‚¬â„¢ÃƒÆ’Ã¢â‚¬Â ÃƒÂ¢Ã¢â€šÂ¬Ã¢â€žÂ¢ÃƒÆ’Ã†â€™ÃƒÂ¢Ã¢â€šÂ¬Ã‚Â ÃƒÆ’Ã‚Â¢ÃƒÂ¢Ã¢â‚¬Å¡Ã‚Â¬ÃƒÂ¢Ã¢â‚¬Å¾Ã‚Â¢ÃƒÆ’Ã†â€™Ãƒâ€ Ã¢â‚¬â„¢ÃƒÆ’Ã‚Â¢ÃƒÂ¢Ã¢â‚¬Å¡Ã‚Â¬Ãƒâ€šÃ‚Â ÃƒÆ’Ã†â€™Ãƒâ€šÃ‚Â¢ÃƒÆ’Ã‚Â¢ÃƒÂ¢Ã¢â€šÂ¬Ã…Â¡Ãƒâ€šÃ‚Â¬ÃƒÆ’Ã‚Â¢ÃƒÂ¢Ã¢â€šÂ¬Ã…Â¾Ãƒâ€šÃ‚Â¢ÃƒÆ’Ã†â€™Ãƒâ€ Ã¢â‚¬â„¢ÃƒÆ’Ã¢â‚¬Â ÃƒÂ¢Ã¢â€šÂ¬Ã¢â€žÂ¢ÃƒÆ’Ã†â€™Ãƒâ€šÃ‚Â¢ÃƒÆ’Ã‚Â¢ÃƒÂ¢Ã¢â€šÂ¬Ã…Â¡Ãƒâ€šÃ‚Â¬ÃƒÆ’Ã¢â‚¬Â¦Ãƒâ€šÃ‚Â¡ÃƒÆ’Ã†â€™Ãƒâ€ Ã¢â‚¬â„¢ÃƒÆ’Ã‚Â¢ÃƒÂ¢Ã¢â‚¬Å¡Ã‚Â¬Ãƒâ€¦Ã‚Â¡ÃƒÆ’Ã†â€™ÃƒÂ¢Ã¢â€šÂ¬Ã…Â¡ÃƒÆ’Ã¢â‚¬Å¡Ãƒâ€šÃ‚Â¢ÃƒÆ’Ã†â€™Ãƒâ€ Ã¢â‚¬â„¢ÃƒÆ’Ã¢â‚¬Â ÃƒÂ¢Ã¢â€šÂ¬Ã¢â€žÂ¢ÃƒÆ’Ã†â€™ÃƒÂ¢Ã¢â€šÂ¬Ã‚Â ÃƒÆ’Ã‚Â¢ÃƒÂ¢Ã¢â‚¬Å¡Ã‚Â¬ÃƒÂ¢Ã¢â‚¬Å¾Ã‚Â¢ÃƒÆ’Ã†â€™Ãƒâ€ Ã¢â‚¬â„¢ÃƒÆ’Ã‚Â¢ÃƒÂ¢Ã¢â‚¬Å¡Ã‚Â¬Ãƒâ€¦Ã‚Â¡ÃƒÆ’Ã†â€™ÃƒÂ¢Ã¢â€šÂ¬Ã…Â¡ÃƒÆ’Ã¢â‚¬Å¡Ãƒâ€šÃ‚Â¢ÃƒÆ’Ã†â€™Ãƒâ€ Ã¢â‚¬â„¢ÃƒÆ’Ã¢â‚¬Â ÃƒÂ¢Ã¢â€šÂ¬Ã¢â€žÂ¢ÃƒÆ’Ã†â€™ÃƒÂ¢Ã¢â€šÂ¬Ã…Â¡ÃƒÆ’Ã¢â‚¬Å¡Ãƒâ€šÃ‚Â¢ÃƒÆ’Ã†â€™Ãƒâ€ Ã¢â‚¬â„¢ÃƒÆ’Ã¢â‚¬Å¡Ãƒâ€šÃ‚Â¢ÃƒÆ’Ã†â€™Ãƒâ€šÃ‚Â¢ÃƒÆ’Ã‚Â¢ÃƒÂ¢Ã¢â€šÂ¬Ã…Â¡Ãƒâ€šÃ‚Â¬ÃƒÆ’Ã¢â‚¬Â¦Ãƒâ€šÃ‚Â¡ÃƒÆ’Ã†â€™ÃƒÂ¢Ã¢â€šÂ¬Ã…Â¡ÃƒÆ’Ã¢â‚¬Å¡Ãƒâ€šÃ‚Â¬ÃƒÆ’Ã†â€™Ãƒâ€ Ã¢â‚¬â„¢ÃƒÆ’Ã‚Â¢ÃƒÂ¢Ã¢â‚¬Å¡Ã‚Â¬Ãƒâ€šÃ‚Â¦ÃƒÆ’Ã†â€™ÃƒÂ¢Ã¢â€šÂ¬Ã…Â¡ÃƒÆ’Ã¢â‚¬Å¡Ãƒâ€šÃ‚Â¡ÃƒÆ’Ã†â€™Ãƒâ€ Ã¢â‚¬â„¢ÃƒÆ’Ã¢â‚¬Â ÃƒÂ¢Ã¢â€šÂ¬Ã¢â€žÂ¢ÃƒÆ’Ã†â€™Ãƒâ€šÃ‚Â¢ÃƒÆ’Ã‚Â¢ÃƒÂ¢Ã¢â€šÂ¬Ã…Â¡Ãƒâ€šÃ‚Â¬ÃƒÆ’Ã¢â‚¬Â¦Ãƒâ€šÃ‚Â¡ÃƒÆ’Ã†â€™Ãƒâ€ Ã¢â‚¬â„¢ÃƒÆ’Ã‚Â¢ÃƒÂ¢Ã¢â‚¬Å¡Ã‚Â¬Ãƒâ€¦Ã‚Â¡ÃƒÆ’Ã†â€™ÃƒÂ¢Ã¢â€šÂ¬Ã…Â¡ÃƒÆ’Ã¢â‚¬Å¡Ãƒâ€šÃ‚Â¬ÃƒÆ’Ã†â€™Ãƒâ€ Ã¢â‚¬â„¢ÃƒÆ’Ã¢â‚¬Â ÃƒÂ¢Ã¢â€šÂ¬Ã¢â€žÂ¢ÃƒÆ’Ã†â€™ÃƒÂ¢Ã¢â€šÂ¬Ã‚Â ÃƒÆ’Ã‚Â¢ÃƒÂ¢Ã¢â‚¬Å¡Ã‚Â¬ÃƒÂ¢Ã¢â‚¬Å¾Ã‚Â¢ÃƒÆ’Ã†â€™Ãƒâ€ Ã¢â‚¬â„¢ÃƒÆ’Ã¢â‚¬Å¡Ãƒâ€šÃ‚Â¢ÃƒÆ’Ã†â€™Ãƒâ€šÃ‚Â¢ÃƒÆ’Ã‚Â¢ÃƒÂ¢Ã¢â‚¬Å¡Ã‚Â¬Ãƒâ€¦Ã‚Â¡ÃƒÆ’Ã¢â‚¬Å¡Ãƒâ€šÃ‚Â¬ÃƒÆ’Ã†â€™ÃƒÂ¢Ã¢â€šÂ¬Ã…Â¡ÃƒÆ’Ã¢â‚¬Å¡Ãƒâ€šÃ‚Â¦ÃƒÆ’Ã†â€™Ãƒâ€ Ã¢â‚¬â„¢ÃƒÆ’Ã¢â‚¬Â ÃƒÂ¢Ã¢â€šÂ¬Ã¢â€žÂ¢ÃƒÆ’Ã†â€™Ãƒâ€šÃ‚Â¢ÃƒÆ’Ã‚Â¢ÃƒÂ¢Ã¢â€šÂ¬Ã…Â¡Ãƒâ€šÃ‚Â¬ÃƒÆ’Ã¢â‚¬Â¦Ãƒâ€šÃ‚Â¡ÃƒÆ’Ã†â€™Ãƒâ€ Ã¢â‚¬â„¢ÃƒÆ’Ã‚Â¢ÃƒÂ¢Ã¢â‚¬Å¡Ã‚Â¬Ãƒâ€¦Ã‚Â¡ÃƒÆ’Ã†â€™ÃƒÂ¢Ã¢â€šÂ¬Ã…Â¡ÃƒÆ’Ã¢â‚¬Å¡Ãƒâ€šÃ‚Â¡ÃƒÆ’Ã†â€™Ãƒâ€ Ã¢â‚¬â„¢ÃƒÆ’Ã¢â‚¬Â ÃƒÂ¢Ã¢â€šÂ¬Ã¢â€žÂ¢ÃƒÆ’Ã†â€™ÃƒÂ¢Ã¢â€šÂ¬Ã‚Â ÃƒÆ’Ã‚Â¢ÃƒÂ¢Ã¢â‚¬Å¡Ã‚Â¬ÃƒÂ¢Ã¢â‚¬Å¾Ã‚Â¢ÃƒÆ’Ã†â€™Ãƒâ€ Ã¢â‚¬â„¢ÃƒÆ’Ã‚Â¢ÃƒÂ¢Ã¢â‚¬Å¡Ã‚Â¬Ãƒâ€šÃ‚Â ÃƒÆ’Ã†â€™Ãƒâ€šÃ‚Â¢ÃƒÆ’Ã‚Â¢ÃƒÂ¢Ã¢â€šÂ¬Ã…Â¡Ãƒâ€šÃ‚Â¬ÃƒÆ’Ã‚Â¢ÃƒÂ¢Ã¢â€šÂ¬Ã…Â¾Ãƒâ€šÃ‚Â¢ÃƒÆ’Ã†â€™Ãƒâ€ Ã¢â‚¬â„¢ÃƒÆ’Ã¢â‚¬Â ÃƒÂ¢Ã¢â€šÂ¬Ã¢â€žÂ¢ÃƒÆ’Ã†â€™Ãƒâ€šÃ‚Â¢ÃƒÆ’Ã‚Â¢ÃƒÂ¢Ã¢â€šÂ¬Ã…Â¡Ãƒâ€šÃ‚Â¬ÃƒÆ’Ã¢â‚¬Å¡Ãƒâ€šÃ‚Â ÃƒÆ’Ã†â€™Ãƒâ€ Ã¢â‚¬â„¢ÃƒÆ’Ã¢â‚¬Å¡Ãƒâ€šÃ‚Â¢ÃƒÆ’Ã†â€™Ãƒâ€šÃ‚Â¢ÃƒÆ’Ã‚Â¢ÃƒÂ¢Ã¢â‚¬Å¡Ã‚Â¬Ãƒâ€¦Ã‚Â¡ÃƒÆ’Ã¢â‚¬Å¡Ãƒâ€šÃ‚Â¬ÃƒÆ’Ã†â€™Ãƒâ€šÃ‚Â¢ÃƒÆ’Ã‚Â¢ÃƒÂ¢Ã¢â‚¬Å¡Ã‚Â¬Ãƒâ€¦Ã‚Â¾ÃƒÆ’Ã¢â‚¬Å¡Ãƒâ€šÃ‚Â¢ÃƒÆ’Ã†â€™Ãƒâ€ Ã¢â‚¬â„¢ÃƒÆ’Ã¢â‚¬Â ÃƒÂ¢Ã¢â€šÂ¬Ã¢â€žÂ¢ÃƒÆ’Ã†â€™ÃƒÂ¢Ã¢â€šÂ¬Ã‚Â ÃƒÆ’Ã‚Â¢ÃƒÂ¢Ã¢â‚¬Å¡Ã‚Â¬ÃƒÂ¢Ã¢â‚¬Å¾Ã‚Â¢ÃƒÆ’Ã†â€™Ãƒâ€ Ã¢â‚¬â„¢ÃƒÆ’Ã¢â‚¬Å¡Ãƒâ€šÃ‚Â¢ÃƒÆ’Ã†â€™Ãƒâ€šÃ‚Â¢ÃƒÆ’Ã‚Â¢ÃƒÂ¢Ã¢â‚¬Å¡Ã‚Â¬Ãƒâ€¦Ã‚Â¡ÃƒÆ’Ã¢â‚¬Å¡Ãƒâ€šÃ‚Â¬ÃƒÆ’Ã†â€™ÃƒÂ¢Ã¢â€šÂ¬Ã‚Â¦ÃƒÆ’Ã¢â‚¬Å¡Ãƒâ€šÃ‚Â¡ÃƒÆ’Ã†â€™Ãƒâ€ Ã¢â‚¬â„¢ÃƒÆ’Ã¢â‚¬Â ÃƒÂ¢Ã¢â€šÂ¬Ã¢â€žÂ¢ÃƒÆ’Ã†â€™Ãƒâ€šÃ‚Â¢ÃƒÆ’Ã‚Â¢ÃƒÂ¢Ã¢â€šÂ¬Ã…Â¡Ãƒâ€šÃ‚Â¬ÃƒÆ’Ã¢â‚¬Â¦Ãƒâ€šÃ‚Â¡ÃƒÆ’Ã†â€™Ãƒâ€ Ã¢â‚¬â„¢ÃƒÆ’Ã‚Â¢ÃƒÂ¢Ã¢â‚¬Å¡Ã‚Â¬Ãƒâ€¦Ã‚Â¡ÃƒÆ’Ã†â€™ÃƒÂ¢Ã¢â€šÂ¬Ã…Â¡ÃƒÆ’Ã¢â‚¬Å¡Ãƒâ€šÃ‚Â¢ÃƒÆ’Ã†â€™Ãƒâ€ Ã¢â‚¬â„¢ÃƒÆ’Ã¢â‚¬Â ÃƒÂ¢Ã¢â€šÂ¬Ã¢â€žÂ¢ÃƒÆ’Ã†â€™ÃƒÂ¢Ã¢â€šÂ¬Ã‚Â ÃƒÆ’Ã‚Â¢ÃƒÂ¢Ã¢â‚¬Å¡Ã‚Â¬ÃƒÂ¢Ã¢â‚¬Å¾Ã‚Â¢ÃƒÆ’Ã†â€™Ãƒâ€ Ã¢â‚¬â„¢ÃƒÆ’Ã‚Â¢ÃƒÂ¢Ã¢â‚¬Å¡Ã‚Â¬Ãƒâ€šÃ‚Â ÃƒÆ’Ã†â€™Ãƒâ€šÃ‚Â¢ÃƒÆ’Ã‚Â¢ÃƒÂ¢Ã¢â€šÂ¬Ã…Â¡Ãƒâ€šÃ‚Â¬ÃƒÆ’Ã‚Â¢ÃƒÂ¢Ã¢â€šÂ¬Ã…Â¾Ãƒâ€šÃ‚Â¢ÃƒÆ’Ã†â€™Ãƒâ€ Ã¢â‚¬â„¢ÃƒÆ’Ã¢â‚¬Â ÃƒÂ¢Ã¢â€šÂ¬Ã¢â€žÂ¢ÃƒÆ’Ã†â€™ÃƒÂ¢Ã¢â€šÂ¬Ã…Â¡ÃƒÆ’Ã¢â‚¬Å¡Ãƒâ€šÃ‚Â¢ÃƒÆ’Ã†â€™Ãƒâ€ Ã¢â‚¬â„¢ÃƒÆ’Ã¢â‚¬Å¡Ãƒâ€šÃ‚Â¢ÃƒÆ’Ã†â€™Ãƒâ€šÃ‚Â¢ÃƒÆ’Ã‚Â¢ÃƒÂ¢Ã¢â€šÂ¬Ã…Â¡Ãƒâ€šÃ‚Â¬ÃƒÆ’Ã¢â‚¬Â¦Ãƒâ€šÃ‚Â¡ÃƒÆ’Ã†â€™ÃƒÂ¢Ã¢â€šÂ¬Ã…Â¡ÃƒÆ’Ã¢â‚¬Å¡Ãƒâ€šÃ‚Â¬ÃƒÆ’Ã†â€™Ãƒâ€ Ã¢â‚¬â„¢ÃƒÆ’Ã‚Â¢ÃƒÂ¢Ã¢â‚¬Å¡Ã‚Â¬Ãƒâ€šÃ‚Â¦ÃƒÆ’Ã†â€™ÃƒÂ¢Ã¢â€šÂ¬Ã…Â¡ÃƒÆ’Ã¢â‚¬Å¡Ãƒâ€šÃ‚Â¡ÃƒÆ’Ã†â€™Ãƒâ€ Ã¢â‚¬â„¢ÃƒÆ’Ã¢â‚¬Â ÃƒÂ¢Ã¢â€šÂ¬Ã¢â€žÂ¢ÃƒÆ’Ã†â€™ÃƒÂ¢Ã¢â€šÂ¬Ã‚Â ÃƒÆ’Ã‚Â¢ÃƒÂ¢Ã¢â‚¬Å¡Ã‚Â¬ÃƒÂ¢Ã¢â‚¬Å¾Ã‚Â¢ÃƒÆ’Ã†â€™Ãƒâ€ Ã¢â‚¬â„¢ÃƒÆ’Ã¢â‚¬Å¡Ãƒâ€šÃ‚Â¢ÃƒÆ’Ã†â€™Ãƒâ€šÃ‚Â¢ÃƒÆ’Ã‚Â¢ÃƒÂ¢Ã¢â‚¬Å¡Ã‚Â¬Ãƒâ€¦Ã‚Â¡ÃƒÆ’Ã¢â‚¬Å¡Ãƒâ€šÃ‚Â¬ÃƒÆ’Ã†â€™ÃƒÂ¢Ã¢â€šÂ¬Ã‚Â¦ÃƒÆ’Ã¢â‚¬Å¡Ãƒâ€šÃ‚Â¡ÃƒÆ’Ã†â€™Ãƒâ€ Ã¢â‚¬â„¢ÃƒÆ’Ã¢â‚¬Â ÃƒÂ¢Ã¢â€šÂ¬Ã¢â€žÂ¢ÃƒÆ’Ã†â€™Ãƒâ€šÃ‚Â¢ÃƒÆ’Ã‚Â¢ÃƒÂ¢Ã¢â€šÂ¬Ã…Â¡Ãƒâ€šÃ‚Â¬ÃƒÆ’Ã¢â‚¬Â¦Ãƒâ€šÃ‚Â¡ÃƒÆ’Ã†â€™Ãƒâ€ Ã¢â‚¬â„¢ÃƒÆ’Ã‚Â¢ÃƒÂ¢Ã¢â‚¬Å¡Ã‚Â¬Ãƒâ€¦Ã‚Â¡ÃƒÆ’Ã†â€™ÃƒÂ¢Ã¢â€šÂ¬Ã…Â¡ÃƒÆ’Ã¢â‚¬Å¡Ãƒâ€šÃ‚ÂÃƒÆ’Ã†â€™Ãƒâ€ Ã¢â‚¬â„¢ÃƒÆ’Ã¢â‚¬Â ÃƒÂ¢Ã¢â€šÂ¬Ã¢â€žÂ¢ÃƒÆ’Ã†â€™ÃƒÂ¢Ã¢â€šÂ¬Ã‚Â ÃƒÆ’Ã‚Â¢ÃƒÂ¢Ã¢â‚¬Å¡Ã‚Â¬ÃƒÂ¢Ã¢â‚¬Å¾Ã‚Â¢ÃƒÆ’Ã†â€™Ãƒâ€ Ã¢â‚¬â„¢ÃƒÆ’Ã‚Â¢ÃƒÂ¢Ã¢â‚¬Å¡Ã‚Â¬Ãƒâ€šÃ‚Â ÃƒÆ’Ã†â€™Ãƒâ€šÃ‚Â¢ÃƒÆ’Ã‚Â¢ÃƒÂ¢Ã¢â€šÂ¬Ã…Â¡Ãƒâ€šÃ‚Â¬ÃƒÆ’Ã‚Â¢ÃƒÂ¢Ã¢â€šÂ¬Ã…Â¾Ãƒâ€šÃ‚Â¢ÃƒÆ’Ã†â€™Ãƒâ€ Ã¢â‚¬â„¢ÃƒÆ’Ã¢â‚¬Â ÃƒÂ¢Ã¢â€šÂ¬Ã¢â€žÂ¢ÃƒÆ’Ã†â€™ÃƒÂ¢Ã¢â€šÂ¬Ã…Â¡ÃƒÆ’Ã¢â‚¬Å¡Ãƒâ€šÃ‚Â¢ÃƒÆ’Ã†â€™Ãƒâ€ Ã¢â‚¬â„¢ÃƒÆ’Ã¢â‚¬Å¡Ãƒâ€šÃ‚Â¢ÃƒÆ’Ã†â€™Ãƒâ€šÃ‚Â¢ÃƒÆ’Ã‚Â¢ÃƒÂ¢Ã¢â€šÂ¬Ã…Â¡Ãƒâ€šÃ‚Â¬ÃƒÆ’Ã¢â‚¬Â¦Ãƒâ€šÃ‚Â¡ÃƒÆ’Ã†â€™ÃƒÂ¢Ã¢â€šÂ¬Ã…Â¡ÃƒÆ’Ã¢â‚¬Å¡Ãƒâ€šÃ‚Â¬ÃƒÆ’Ã†â€™Ãƒâ€ Ã¢â‚¬â„¢ÃƒÆ’Ã‚Â¢ÃƒÂ¢Ã¢â‚¬Å¡Ã‚Â¬Ãƒâ€šÃ‚Â¦ÃƒÆ’Ã†â€™ÃƒÂ¢Ã¢â€šÂ¬Ã…Â¡ÃƒÆ’Ã¢â‚¬Å¡Ãƒâ€šÃ‚Â¡ÃƒÆ’Ã†â€™Ãƒâ€ Ã¢â‚¬â„¢ÃƒÆ’Ã¢â‚¬Â ÃƒÂ¢Ã¢â€šÂ¬Ã¢â€žÂ¢ÃƒÆ’Ã†â€™ÃƒÂ¢Ã¢â€šÂ¬Ã‚Â ÃƒÆ’Ã‚Â¢ÃƒÂ¢Ã¢â‚¬Å¡Ã‚Â¬ÃƒÂ¢Ã¢â‚¬Å¾Ã‚Â¢ÃƒÆ’Ã†â€™Ãƒâ€ Ã¢â‚¬â„¢ÃƒÆ’Ã¢â‚¬Å¡Ãƒâ€šÃ‚Â¢ÃƒÆ’Ã†â€™Ãƒâ€šÃ‚Â¢ÃƒÆ’Ã‚Â¢ÃƒÂ¢Ã¢â‚¬Å¡Ã‚Â¬Ãƒâ€¦Ã‚Â¡ÃƒÆ’Ã¢â‚¬Å¡Ãƒâ€šÃ‚Â¬ÃƒÆ’Ã†â€™ÃƒÂ¢Ã¢â€šÂ¬Ã‚Â¦ÃƒÆ’Ã¢â‚¬Å¡Ãƒâ€šÃ‚Â¡ÃƒÆ’Ã†â€™Ãƒâ€ Ã¢â‚¬â„¢ÃƒÆ’Ã¢â‚¬Â ÃƒÂ¢Ã¢â€šÂ¬Ã¢â€žÂ¢ÃƒÆ’Ã†â€™Ãƒâ€šÃ‚Â¢ÃƒÆ’Ã‚Â¢ÃƒÂ¢Ã¢â€šÂ¬Ã…Â¡Ãƒâ€šÃ‚Â¬ÃƒÆ’Ã¢â‚¬Â¦Ãƒâ€šÃ‚Â¡ÃƒÆ’Ã†â€™Ãƒâ€ Ã¢â‚¬â„¢ÃƒÆ’Ã‚Â¢ÃƒÂ¢Ã¢â‚¬Å¡Ã‚Â¬Ãƒâ€¦Ã‚Â¡ÃƒÆ’Ã†â€™ÃƒÂ¢Ã¢â€šÂ¬Ã…Â¡ÃƒÆ’Ã¢â‚¬Å¡Ãƒâ€šÃ‚Â»-N) concentration (</w:t>
+        <w:t>The bar chart illustrates the changes in nitrite nitrogen (NOÃƒÆ’Ã†â€™Ãƒâ€ Ã¢â‚¬â„¢ÃƒÆ’Ã¢â‚¬Â ÃƒÂ¢Ã¢â€šÂ¬Ã¢â€žÂ¢ÃƒÆ’Ã†â€™ÃƒÂ¢Ã¢â€šÂ¬Ã‚Â ÃƒÆ’Ã‚Â¢ÃƒÂ¢Ã¢â‚¬Å¡Ã‚Â¬ÃƒÂ¢Ã¢â‚¬Å¾Ã‚Â¢ÃƒÆ’Ã†â€™Ãƒâ€ Ã¢â‚¬â„¢ÃƒÆ’Ã‚Â¢ÃƒÂ¢Ã¢â‚¬Å¡Ã‚Â¬Ãƒâ€šÃ‚Â ÃƒÆ’Ã†â€™Ãƒâ€šÃ‚Â¢ÃƒÆ’Ã‚Â¢ÃƒÂ¢Ã¢â€šÂ¬Ã…Â¡Ãƒâ€šÃ‚Â¬ÃƒÆ’Ã‚Â¢ÃƒÂ¢Ã¢â€šÂ¬Ã…Â¾Ãƒâ€šÃ‚Â¢ÃƒÆ’Ã†â€™Ãƒâ€ Ã¢â‚¬â„¢ÃƒÆ’Ã¢â‚¬Â ÃƒÂ¢Ã¢â€šÂ¬Ã¢â€žÂ¢ÃƒÆ’Ã†â€™Ãƒâ€šÃ‚Â¢ÃƒÆ’Ã‚Â¢ÃƒÂ¢Ã¢â€šÂ¬Ã…Â¡Ãƒâ€šÃ‚Â¬ÃƒÆ’Ã¢â‚¬Å¡Ãƒâ€šÃ‚Â ÃƒÆ’Ã†â€™Ãƒâ€ Ã¢â‚¬â„¢ÃƒÆ’Ã¢â‚¬Å¡Ãƒâ€šÃ‚Â¢ÃƒÆ’Ã†â€™Ãƒâ€šÃ‚Â¢ÃƒÆ’Ã‚Â¢ÃƒÂ¢Ã¢â‚¬Å¡Ã‚Â¬Ãƒâ€¦Ã‚Â¡ÃƒÆ’Ã¢â‚¬Å¡Ãƒâ€šÃ‚Â¬ÃƒÆ’Ã†â€™Ãƒâ€šÃ‚Â¢ÃƒÆ’Ã‚Â¢ÃƒÂ¢Ã¢â‚¬Å¡Ã‚Â¬Ãƒâ€¦Ã‚Â¾ÃƒÆ’Ã¢â‚¬Å¡Ãƒâ€šÃ‚Â¢ÃƒÆ’Ã†â€™Ãƒâ€ Ã¢â‚¬â„¢ÃƒÆ’Ã¢â‚¬Â ÃƒÂ¢Ã¢â€šÂ¬Ã¢â€žÂ¢ÃƒÆ’Ã†â€™ÃƒÂ¢Ã¢â€šÂ¬Ã‚Â ÃƒÆ’Ã‚Â¢ÃƒÂ¢Ã¢â‚¬Å¡Ã‚Â¬ÃƒÂ¢Ã¢â‚¬Å¾Ã‚Â¢ÃƒÆ’Ã†â€™Ãƒâ€ Ã¢â‚¬â„¢ÃƒÆ’Ã¢â‚¬Å¡Ãƒâ€šÃ‚Â¢ÃƒÆ’Ã†â€™Ãƒâ€šÃ‚Â¢ÃƒÆ’Ã‚Â¢ÃƒÂ¢Ã¢â‚¬Å¡Ã‚Â¬Ãƒâ€¦Ã‚Â¡ÃƒÆ’Ã¢â‚¬Å¡Ãƒâ€šÃ‚Â¬ÃƒÆ’Ã†â€™ÃƒÂ¢Ã¢â€šÂ¬Ã…Â¡ÃƒÆ’Ã¢â‚¬Å¡Ãƒâ€šÃ‚Â ÃƒÆ’Ã†â€™Ãƒâ€ Ã¢â‚¬â„¢ÃƒÆ’Ã¢â‚¬Â ÃƒÂ¢Ã¢â€šÂ¬Ã¢â€žÂ¢ÃƒÆ’Ã†â€™ÃƒÂ¢Ã¢â€šÂ¬Ã…Â¡ÃƒÆ’Ã¢â‚¬Å¡Ãƒâ€šÃ‚Â¢ÃƒÆ’Ã†â€™Ãƒâ€ Ã¢â‚¬â„¢ÃƒÆ’Ã¢â‚¬Å¡Ãƒâ€šÃ‚Â¢ÃƒÆ’Ã†â€™Ãƒâ€šÃ‚Â¢ÃƒÆ’Ã‚Â¢ÃƒÂ¢Ã¢â€šÂ¬Ã…Â¡Ãƒâ€šÃ‚Â¬ÃƒÆ’Ã¢â‚¬Â¦Ãƒâ€šÃ‚Â¡ÃƒÆ’Ã†â€™ÃƒÂ¢Ã¢â€šÂ¬Ã…Â¡ÃƒÆ’Ã¢â‚¬Å¡Ãƒâ€šÃ‚Â¬ÃƒÆ’Ã†â€™Ãƒâ€ Ã¢â‚¬â„¢ÃƒÆ’Ã¢â‚¬Å¡Ãƒâ€šÃ‚Â¢ÃƒÆ’Ã†â€™Ãƒâ€šÃ‚Â¢ÃƒÆ’Ã‚Â¢ÃƒÂ¢Ã¢â€šÂ¬Ã…Â¡Ãƒâ€šÃ‚Â¬ÃƒÆ’Ã¢â‚¬Â¦Ãƒâ€šÃ‚Â¾ÃƒÆ’Ã†â€™ÃƒÂ¢Ã¢â€šÂ¬Ã…Â¡ÃƒÆ’Ã¢â‚¬Å¡Ãƒâ€šÃ‚Â¢ÃƒÆ’Ã†â€™Ãƒâ€ Ã¢â‚¬â„¢ÃƒÆ’Ã¢â‚¬Â ÃƒÂ¢Ã¢â€šÂ¬Ã¢â€žÂ¢ÃƒÆ’Ã†â€™ÃƒÂ¢Ã¢â€šÂ¬Ã‚Â ÃƒÆ’Ã‚Â¢ÃƒÂ¢Ã¢â‚¬Å¡Ã‚Â¬ÃƒÂ¢Ã¢â‚¬Å¾Ã‚Â¢ÃƒÆ’Ã†â€™Ãƒâ€ Ã¢â‚¬â„¢ÃƒÆ’Ã‚Â¢ÃƒÂ¢Ã¢â‚¬Å¡Ã‚Â¬Ãƒâ€šÃ‚Â ÃƒÆ’Ã†â€™Ãƒâ€šÃ‚Â¢ÃƒÆ’Ã‚Â¢ÃƒÂ¢Ã¢â€šÂ¬Ã…Â¡Ãƒâ€šÃ‚Â¬ÃƒÆ’Ã‚Â¢ÃƒÂ¢Ã¢â€šÂ¬Ã…Â¾Ãƒâ€šÃ‚Â¢ÃƒÆ’Ã†â€™Ãƒâ€ Ã¢â‚¬â„¢ÃƒÆ’Ã¢â‚¬Â ÃƒÂ¢Ã¢â€šÂ¬Ã¢â€žÂ¢ÃƒÆ’Ã†â€™ÃƒÂ¢Ã¢â€šÂ¬Ã…Â¡ÃƒÆ’Ã¢â‚¬Å¡Ãƒâ€šÃ‚Â¢ÃƒÆ’Ã†â€™Ãƒâ€ Ã¢â‚¬â„¢ÃƒÆ’Ã¢â‚¬Å¡Ãƒâ€šÃ‚Â¢ÃƒÆ’Ã†â€™Ãƒâ€šÃ‚Â¢ÃƒÆ’Ã‚Â¢ÃƒÂ¢Ã¢â€šÂ¬Ã…Â¡Ãƒâ€šÃ‚Â¬ÃƒÆ’Ã¢â‚¬Â¦Ãƒâ€šÃ‚Â¡ÃƒÆ’Ã†â€™ÃƒÂ¢Ã¢â€šÂ¬Ã…Â¡ÃƒÆ’Ã¢â‚¬Å¡Ãƒâ€šÃ‚Â¬ÃƒÆ’Ã†â€™Ãƒâ€ Ã¢â‚¬â„¢ÃƒÆ’Ã‚Â¢ÃƒÂ¢Ã¢â‚¬Å¡Ã‚Â¬Ãƒâ€šÃ‚Â¦ÃƒÆ’Ã†â€™ÃƒÂ¢Ã¢â€šÂ¬Ã…Â¡ÃƒÆ’Ã¢â‚¬Å¡Ãƒâ€šÃ‚Â¡ÃƒÆ’Ã†â€™Ãƒâ€ Ã¢â‚¬â„¢ÃƒÆ’Ã¢â‚¬Â ÃƒÂ¢Ã¢â€šÂ¬Ã¢â€žÂ¢ÃƒÆ’Ã†â€™ÃƒÂ¢Ã¢â€šÂ¬Ã‚Â ÃƒÆ’Ã‚Â¢ÃƒÂ¢Ã¢â‚¬Å¡Ã‚Â¬ÃƒÂ¢Ã¢â‚¬Å¾Ã‚Â¢ÃƒÆ’Ã†â€™Ãƒâ€ Ã¢â‚¬â„¢ÃƒÆ’Ã¢â‚¬Å¡Ãƒâ€šÃ‚Â¢ÃƒÆ’Ã†â€™Ãƒâ€šÃ‚Â¢ÃƒÆ’Ã‚Â¢ÃƒÂ¢Ã¢â‚¬Å¡Ã‚Â¬Ãƒâ€¦Ã‚Â¡ÃƒÆ’Ã¢â‚¬Å¡Ãƒâ€šÃ‚Â¬ÃƒÆ’Ã†â€™ÃƒÂ¢Ã¢â€šÂ¬Ã‚Â¦ÃƒÆ’Ã¢â‚¬Å¡Ãƒâ€šÃ‚Â¡ÃƒÆ’Ã†â€™Ãƒâ€ Ã¢â‚¬â„¢ÃƒÆ’Ã¢â‚¬Â ÃƒÂ¢Ã¢â€šÂ¬Ã¢â€žÂ¢ÃƒÆ’Ã†â€™Ãƒâ€šÃ‚Â¢ÃƒÆ’Ã‚Â¢ÃƒÂ¢Ã¢â€šÂ¬Ã…Â¡Ãƒâ€šÃ‚Â¬ÃƒÆ’Ã¢â‚¬Â¦Ãƒâ€šÃ‚Â¡ÃƒÆ’Ã†â€™Ãƒâ€ Ã¢â‚¬â„¢ÃƒÆ’Ã‚Â¢ÃƒÂ¢Ã¢â‚¬Å¡Ã‚Â¬Ãƒâ€¦Ã‚Â¡ÃƒÆ’Ã†â€™ÃƒÂ¢Ã¢â€šÂ¬Ã…Â¡ÃƒÆ’Ã¢â‚¬Å¡Ãƒâ€šÃ‚Â¢ÃƒÆ’Ã†â€™Ãƒâ€ Ã¢â‚¬â„¢ÃƒÆ’Ã¢â‚¬Â ÃƒÂ¢Ã¢â€šÂ¬Ã¢â€žÂ¢ÃƒÆ’Ã†â€™ÃƒÂ¢Ã¢â€šÂ¬Ã‚Â ÃƒÆ’Ã‚Â¢ÃƒÂ¢Ã¢â‚¬Å¡Ã‚Â¬ÃƒÂ¢Ã¢â‚¬Å¾Ã‚Â¢ÃƒÆ’Ã†â€™Ãƒâ€ Ã¢â‚¬â„¢ÃƒÆ’Ã‚Â¢ÃƒÂ¢Ã¢â‚¬Å¡Ã‚Â¬Ãƒâ€šÃ‚Â ÃƒÆ’Ã†â€™Ãƒâ€šÃ‚Â¢ÃƒÆ’Ã‚Â¢ÃƒÂ¢Ã¢â€šÂ¬Ã…Â¡Ãƒâ€šÃ‚Â¬ÃƒÆ’Ã‚Â¢ÃƒÂ¢Ã¢â€šÂ¬Ã…Â¾Ãƒâ€šÃ‚Â¢ÃƒÆ’Ã†â€™Ãƒâ€ Ã¢â‚¬â„¢ÃƒÆ’Ã¢â‚¬Â ÃƒÂ¢Ã¢â€šÂ¬Ã¢â€žÂ¢ÃƒÆ’Ã†â€™Ãƒâ€šÃ‚Â¢ÃƒÆ’Ã‚Â¢ÃƒÂ¢Ã¢â€šÂ¬Ã…Â¡Ãƒâ€šÃ‚Â¬ÃƒÆ’Ã¢â‚¬Å¡Ãƒâ€šÃ‚Â ÃƒÆ’Ã†â€™Ãƒâ€ Ã¢â‚¬â„¢ÃƒÆ’Ã¢â‚¬Å¡Ãƒâ€šÃ‚Â¢ÃƒÆ’Ã†â€™Ãƒâ€šÃ‚Â¢ÃƒÆ’Ã‚Â¢ÃƒÂ¢Ã¢â‚¬Å¡Ã‚Â¬Ãƒâ€¦Ã‚Â¡ÃƒÆ’Ã¢â‚¬Å¡Ãƒâ€šÃ‚Â¬ÃƒÆ’Ã†â€™Ãƒâ€šÃ‚Â¢ÃƒÆ’Ã‚Â¢ÃƒÂ¢Ã¢â‚¬Å¡Ã‚Â¬Ãƒâ€¦Ã‚Â¾ÃƒÆ’Ã¢â‚¬Å¡Ãƒâ€šÃ‚Â¢ÃƒÆ’Ã†â€™Ãƒâ€ Ã¢â‚¬â„¢ÃƒÆ’Ã¢â‚¬Â ÃƒÂ¢Ã¢â€šÂ¬Ã¢â€žÂ¢ÃƒÆ’Ã†â€™ÃƒÂ¢Ã¢â€šÂ¬Ã‚Â ÃƒÆ’Ã‚Â¢ÃƒÂ¢Ã¢â‚¬Å¡Ã‚Â¬ÃƒÂ¢Ã¢â‚¬Å¾Ã‚Â¢ÃƒÆ’Ã†â€™Ãƒâ€ Ã¢â‚¬â„¢ÃƒÆ’Ã¢â‚¬Å¡Ãƒâ€šÃ‚Â¢ÃƒÆ’Ã†â€™Ãƒâ€šÃ‚Â¢ÃƒÆ’Ã‚Â¢ÃƒÂ¢Ã¢â‚¬Å¡Ã‚Â¬Ãƒâ€¦Ã‚Â¡ÃƒÆ’Ã¢â‚¬Å¡Ãƒâ€šÃ‚Â¬ÃƒÆ’Ã†â€™ÃƒÂ¢Ã¢â€šÂ¬Ã‚Â¦ÃƒÆ’Ã¢â‚¬Å¡Ãƒâ€šÃ‚Â¡ÃƒÆ’Ã†â€™Ãƒâ€ Ã¢â‚¬â„¢ÃƒÆ’Ã¢â‚¬Â ÃƒÂ¢Ã¢â€šÂ¬Ã¢â€žÂ¢ÃƒÆ’Ã†â€™Ãƒâ€šÃ‚Â¢ÃƒÆ’Ã‚Â¢ÃƒÂ¢Ã¢â€šÂ¬Ã…Â¡Ãƒâ€šÃ‚Â¬ÃƒÆ’Ã¢â‚¬Â¦Ãƒâ€šÃ‚Â¡ÃƒÆ’Ã†â€™Ãƒâ€ Ã¢â‚¬â„¢ÃƒÆ’Ã‚Â¢ÃƒÂ¢Ã¢â‚¬Å¡Ã‚Â¬Ãƒâ€¦Ã‚Â¡ÃƒÆ’Ã†â€™ÃƒÂ¢Ã¢â€šÂ¬Ã…Â¡ÃƒÆ’Ã¢â‚¬Å¡Ãƒâ€šÃ‚Â¢ÃƒÆ’Ã†â€™Ãƒâ€ Ã¢â‚¬â„¢ÃƒÆ’Ã¢â‚¬Â ÃƒÂ¢Ã¢â€šÂ¬Ã¢â€žÂ¢ÃƒÆ’Ã†â€™ÃƒÂ¢Ã¢â€šÂ¬Ã‚Â ÃƒÆ’Ã‚Â¢ÃƒÂ¢Ã¢â‚¬Å¡Ã‚Â¬ÃƒÂ¢Ã¢â‚¬Å¾Ã‚Â¢ÃƒÆ’Ã†â€™Ãƒâ€ Ã¢â‚¬â„¢ÃƒÆ’Ã‚Â¢ÃƒÂ¢Ã¢â‚¬Å¡Ã‚Â¬Ãƒâ€šÃ‚Â ÃƒÆ’Ã†â€™Ãƒâ€šÃ‚Â¢ÃƒÆ’Ã‚Â¢ÃƒÂ¢Ã¢â€šÂ¬Ã…Â¡Ãƒâ€šÃ‚Â¬ÃƒÆ’Ã‚Â¢ÃƒÂ¢Ã¢â€šÂ¬Ã…Â¾Ãƒâ€šÃ‚Â¢ÃƒÆ’Ã†â€™Ãƒâ€ Ã¢â‚¬â„¢ÃƒÆ’Ã¢â‚¬Â ÃƒÂ¢Ã¢â€šÂ¬Ã¢â€žÂ¢ÃƒÆ’Ã†â€™Ãƒâ€šÃ‚Â¢ÃƒÆ’Ã‚Â¢ÃƒÂ¢Ã¢â€šÂ¬Ã…Â¡Ãƒâ€šÃ‚Â¬ÃƒÆ’Ã¢â‚¬Â¦Ãƒâ€šÃ‚Â¡ÃƒÆ’Ã†â€™Ãƒâ€ Ã¢â‚¬â„¢ÃƒÆ’Ã‚Â¢ÃƒÂ¢Ã¢â‚¬Å¡Ã‚Â¬Ãƒâ€¦Ã‚Â¡ÃƒÆ’Ã†â€™ÃƒÂ¢Ã¢â€šÂ¬Ã…Â¡ÃƒÆ’Ã¢â‚¬Å¡Ãƒâ€šÃ‚Â¢ÃƒÆ’Ã†â€™Ãƒâ€ Ã¢â‚¬â„¢ÃƒÆ’Ã¢â‚¬Â ÃƒÂ¢Ã¢â€šÂ¬Ã¢â€žÂ¢ÃƒÆ’Ã†â€™ÃƒÂ¢Ã¢â€šÂ¬Ã‚Â ÃƒÆ’Ã‚Â¢ÃƒÂ¢Ã¢â‚¬Å¡Ã‚Â¬ÃƒÂ¢Ã¢â‚¬Å¾Ã‚Â¢ÃƒÆ’Ã†â€™Ãƒâ€ Ã¢â‚¬â„¢ÃƒÆ’Ã‚Â¢ÃƒÂ¢Ã¢â‚¬Å¡Ã‚Â¬Ãƒâ€¦Ã‚Â¡ÃƒÆ’Ã†â€™ÃƒÂ¢Ã¢â€šÂ¬Ã…Â¡ÃƒÆ’Ã¢â‚¬Å¡Ãƒâ€šÃ‚Â¢ÃƒÆ’Ã†â€™Ãƒâ€ Ã¢â‚¬â„¢ÃƒÆ’Ã¢â‚¬Â ÃƒÂ¢Ã¢â€šÂ¬Ã¢â€žÂ¢ÃƒÆ’Ã†â€™ÃƒÂ¢Ã¢â€šÂ¬Ã…Â¡ÃƒÆ’Ã¢â‚¬Å¡Ãƒâ€šÃ‚Â¢ÃƒÆ’Ã†â€™Ãƒâ€ Ã¢â‚¬â„¢ÃƒÆ’Ã¢â‚¬Å¡Ãƒâ€šÃ‚Â¢ÃƒÆ’Ã†â€™Ãƒâ€šÃ‚Â¢ÃƒÆ’Ã‚Â¢ÃƒÂ¢Ã¢â‚¬Å¡Ã‚Â¬Ãƒâ€¦Ã‚Â¡ÃƒÆ’Ã¢â‚¬Å¡Ãƒâ€šÃ‚Â¬ÃƒÆ’Ã†â€™ÃƒÂ¢Ã¢â€šÂ¬Ã‚Â¦ÃƒÆ’Ã¢â‚¬Å¡Ãƒâ€šÃ‚Â¡ÃƒÆ’Ã†â€™Ãƒâ€ Ã¢â‚¬â„¢ÃƒÆ’Ã‚Â¢ÃƒÂ¢Ã¢â‚¬Å¡Ã‚Â¬Ãƒâ€¦Ã‚Â¡ÃƒÆ’Ã†â€™ÃƒÂ¢Ã¢â€šÂ¬Ã…Â¡ÃƒÆ’Ã¢â‚¬Å¡Ãƒâ€šÃ‚Â¬ÃƒÆ’Ã†â€™Ãƒâ€ Ã¢â‚¬â„¢ÃƒÆ’Ã¢â‚¬Â ÃƒÂ¢Ã¢â€šÂ¬Ã¢â€žÂ¢ÃƒÆ’Ã†â€™Ãƒâ€šÃ‚Â¢ÃƒÆ’Ã‚Â¢ÃƒÂ¢Ã¢â€šÂ¬Ã…Â¡Ãƒâ€šÃ‚Â¬ÃƒÆ’Ã¢â‚¬Å¡Ãƒâ€šÃ‚Â¦ÃƒÆ’Ã†â€™Ãƒâ€ Ã¢â‚¬â„¢ÃƒÆ’Ã‚Â¢ÃƒÂ¢Ã¢â‚¬Å¡Ã‚Â¬Ãƒâ€¦Ã‚Â¡ÃƒÆ’Ã†â€™ÃƒÂ¢Ã¢â€šÂ¬Ã…Â¡ÃƒÆ’Ã¢â‚¬Å¡Ãƒâ€šÃ‚Â¡ÃƒÆ’Ã†â€™Ãƒâ€ Ã¢â‚¬â„¢ÃƒÆ’Ã¢â‚¬Â ÃƒÂ¢Ã¢â€šÂ¬Ã¢â€žÂ¢ÃƒÆ’Ã†â€™ÃƒÂ¢Ã¢â€šÂ¬Ã‚Â ÃƒÆ’Ã‚Â¢ÃƒÂ¢Ã¢â‚¬Å¡Ã‚Â¬ÃƒÂ¢Ã¢â‚¬Å¾Ã‚Â¢ÃƒÆ’Ã†â€™Ãƒâ€ Ã¢â‚¬â„¢ÃƒÆ’Ã¢â‚¬Å¡Ãƒâ€šÃ‚Â¢ÃƒÆ’Ã†â€™Ãƒâ€šÃ‚Â¢ÃƒÆ’Ã‚Â¢ÃƒÂ¢Ã¢â‚¬Å¡Ã‚Â¬Ãƒâ€¦Ã‚Â¡ÃƒÆ’Ã¢â‚¬Å¡Ãƒâ€šÃ‚Â¬ÃƒÆ’Ã†â€™ÃƒÂ¢Ã¢â€šÂ¬Ã‚Â¦ÃƒÆ’Ã¢â‚¬Å¡Ãƒâ€šÃ‚Â¡ÃƒÆ’Ã†â€™Ãƒâ€ Ã¢â‚¬â„¢ÃƒÆ’Ã¢â‚¬Â ÃƒÂ¢Ã¢â€šÂ¬Ã¢â€žÂ¢ÃƒÆ’Ã†â€™Ãƒâ€šÃ‚Â¢ÃƒÆ’Ã‚Â¢ÃƒÂ¢Ã¢â€šÂ¬Ã…Â¡Ãƒâ€šÃ‚Â¬ÃƒÆ’Ã¢â‚¬Â¦Ãƒâ€šÃ‚Â¡ÃƒÆ’Ã†â€™Ãƒâ€ Ã¢â‚¬â„¢ÃƒÆ’Ã‚Â¢ÃƒÂ¢Ã¢â‚¬Å¡Ã‚Â¬Ãƒâ€¦Ã‚Â¡ÃƒÆ’Ã†â€™ÃƒÂ¢Ã¢â€šÂ¬Ã…Â¡ÃƒÆ’Ã¢â‚¬Å¡Ãƒâ€šÃ‚Â¬ÃƒÆ’Ã†â€™Ãƒâ€ Ã¢â‚¬â„¢ÃƒÆ’Ã¢â‚¬Â ÃƒÂ¢Ã¢â€šÂ¬Ã¢â€žÂ¢ÃƒÆ’Ã†â€™ÃƒÂ¢Ã¢â€šÂ¬Ã‚Â ÃƒÆ’Ã‚Â¢ÃƒÂ¢Ã¢â‚¬Å¡Ã‚Â¬ÃƒÂ¢Ã¢â‚¬Å¾Ã‚Â¢ÃƒÆ’Ã†â€™Ãƒâ€ Ã¢â‚¬â„¢ÃƒÆ’Ã‚Â¢ÃƒÂ¢Ã¢â‚¬Å¡Ã‚Â¬Ãƒâ€šÃ‚Â ÃƒÆ’Ã†â€™Ãƒâ€šÃ‚Â¢ÃƒÆ’Ã‚Â¢ÃƒÂ¢Ã¢â€šÂ¬Ã…Â¡Ãƒâ€šÃ‚Â¬ÃƒÆ’Ã‚Â¢ÃƒÂ¢Ã¢â€šÂ¬Ã…Â¾Ãƒâ€šÃ‚Â¢ÃƒÆ’Ã†â€™Ãƒâ€ Ã¢â‚¬â„¢ÃƒÆ’Ã¢â‚¬Â ÃƒÂ¢Ã¢â€šÂ¬Ã¢â€žÂ¢ÃƒÆ’Ã†â€™ÃƒÂ¢Ã¢â€šÂ¬Ã…Â¡ÃƒÆ’Ã¢â‚¬Å¡Ãƒâ€šÃ‚Â¢ÃƒÆ’Ã†â€™Ãƒâ€ Ã¢â‚¬â„¢ÃƒÆ’Ã¢â‚¬Å¡Ãƒâ€šÃ‚Â¢ÃƒÆ’Ã†â€™Ãƒâ€šÃ‚Â¢ÃƒÆ’Ã‚Â¢ÃƒÂ¢Ã¢â€šÂ¬Ã…Â¡Ãƒâ€šÃ‚Â¬ÃƒÆ’Ã¢â‚¬Â¦Ãƒâ€šÃ‚Â¡ÃƒÆ’Ã†â€™ÃƒÂ¢Ã¢â€šÂ¬Ã…Â¡ÃƒÆ’Ã¢â‚¬Å¡Ãƒâ€šÃ‚Â¬ÃƒÆ’Ã†â€™Ãƒâ€ Ã¢â‚¬â„¢ÃƒÆ’Ã‚Â¢ÃƒÂ¢Ã¢â‚¬Å¡Ã‚Â¬Ãƒâ€¦Ã‚Â¡ÃƒÆ’Ã†â€™ÃƒÂ¢Ã¢â€šÂ¬Ã…Â¡ÃƒÆ’Ã¢â‚¬Å¡Ãƒâ€šÃ‚Â¦ÃƒÆ’Ã†â€™Ãƒâ€ Ã¢â‚¬â„¢ÃƒÆ’Ã¢â‚¬Â ÃƒÂ¢Ã¢â€šÂ¬Ã¢â€žÂ¢ÃƒÆ’Ã†â€™ÃƒÂ¢Ã¢â€šÂ¬Ã‚Â ÃƒÆ’Ã‚Â¢ÃƒÂ¢Ã¢â‚¬Å¡Ã‚Â¬ÃƒÂ¢Ã¢â‚¬Å¾Ã‚Â¢ÃƒÆ’Ã†â€™Ãƒâ€ Ã¢â‚¬â„¢ÃƒÆ’Ã¢â‚¬Å¡Ãƒâ€šÃ‚Â¢ÃƒÆ’Ã†â€™Ãƒâ€šÃ‚Â¢ÃƒÆ’Ã‚Â¢ÃƒÂ¢Ã¢â‚¬Å¡Ã‚Â¬Ãƒâ€¦Ã‚Â¡ÃƒÆ’Ã¢â‚¬Å¡Ãƒâ€šÃ‚Â¬ÃƒÆ’Ã†â€™ÃƒÂ¢Ã¢â€šÂ¬Ã‚Â¦ÃƒÆ’Ã¢â‚¬Å¡Ãƒâ€šÃ‚Â¡ÃƒÆ’Ã†â€™Ãƒâ€ Ã¢â‚¬â„¢ÃƒÆ’Ã¢â‚¬Â ÃƒÂ¢Ã¢â€šÂ¬Ã¢â€žÂ¢ÃƒÆ’Ã†â€™Ãƒâ€šÃ‚Â¢ÃƒÆ’Ã‚Â¢ÃƒÂ¢Ã¢â€šÂ¬Ã…Â¡Ãƒâ€šÃ‚Â¬ÃƒÆ’Ã¢â‚¬Â¦Ãƒâ€šÃ‚Â¡ÃƒÆ’Ã†â€™Ãƒâ€ Ã¢â‚¬â„¢ÃƒÆ’Ã‚Â¢ÃƒÂ¢Ã¢â‚¬Å¡Ã‚Â¬Ãƒâ€¦Ã‚Â¡ÃƒÆ’Ã†â€™ÃƒÂ¢Ã¢â€šÂ¬Ã…Â¡ÃƒÆ’Ã¢â‚¬Å¡Ãƒâ€šÃ‚Â¡ÃƒÆ’Ã†â€™Ãƒâ€ Ã¢â‚¬â„¢ÃƒÆ’Ã¢â‚¬Â ÃƒÂ¢Ã¢â€šÂ¬Ã¢â€žÂ¢ÃƒÆ’Ã†â€™ÃƒÂ¢Ã¢â€šÂ¬Ã‚Â ÃƒÆ’Ã‚Â¢ÃƒÂ¢Ã¢â‚¬Å¡Ã‚Â¬ÃƒÂ¢Ã¢â‚¬Å¾Ã‚Â¢ÃƒÆ’Ã†â€™Ãƒâ€ Ã¢â‚¬â„¢ÃƒÆ’Ã‚Â¢ÃƒÂ¢Ã¢â‚¬Å¡Ã‚Â¬Ãƒâ€šÃ‚Â ÃƒÆ’Ã†â€™Ãƒâ€šÃ‚Â¢ÃƒÆ’Ã‚Â¢ÃƒÂ¢Ã¢â€šÂ¬Ã…Â¡Ãƒâ€šÃ‚Â¬ÃƒÆ’Ã‚Â¢ÃƒÂ¢Ã¢â€šÂ¬Ã…Â¾Ãƒâ€šÃ‚Â¢ÃƒÆ’Ã†â€™Ãƒâ€ Ã¢â‚¬â„¢ÃƒÆ’Ã¢â‚¬Â ÃƒÂ¢Ã¢â€šÂ¬Ã¢â€žÂ¢ÃƒÆ’Ã†â€™Ãƒâ€šÃ‚Â¢ÃƒÆ’Ã‚Â¢ÃƒÂ¢Ã¢â€šÂ¬Ã…Â¡Ãƒâ€šÃ‚Â¬ÃƒÆ’Ã¢â‚¬Å¡Ãƒâ€šÃ‚Â ÃƒÆ’Ã†â€™Ãƒâ€ Ã¢â‚¬â„¢ÃƒÆ’Ã¢â‚¬Å¡Ãƒâ€šÃ‚Â¢ÃƒÆ’Ã†â€™Ãƒâ€šÃ‚Â¢ÃƒÆ’Ã‚Â¢ÃƒÂ¢Ã¢â‚¬Å¡Ã‚Â¬Ãƒâ€¦Ã‚Â¡ÃƒÆ’Ã¢â‚¬Å¡Ãƒâ€šÃ‚Â¬ÃƒÆ’Ã†â€™Ãƒâ€šÃ‚Â¢ÃƒÆ’Ã‚Â¢ÃƒÂ¢Ã¢â‚¬Å¡Ã‚Â¬Ãƒâ€¦Ã‚Â¾ÃƒÆ’Ã¢â‚¬Å¡Ãƒâ€šÃ‚Â¢ÃƒÆ’Ã†â€™Ãƒâ€ Ã¢â‚¬â„¢ÃƒÆ’Ã¢â‚¬Â ÃƒÂ¢Ã¢â€šÂ¬Ã¢â€žÂ¢ÃƒÆ’Ã†â€™ÃƒÂ¢Ã¢â€šÂ¬Ã‚Â ÃƒÆ’Ã‚Â¢ÃƒÂ¢Ã¢â‚¬Å¡Ã‚Â¬ÃƒÂ¢Ã¢â‚¬Å¾Ã‚Â¢ÃƒÆ’Ã†â€™Ãƒâ€ Ã¢â‚¬â„¢ÃƒÆ’Ã¢â‚¬Å¡Ãƒâ€šÃ‚Â¢ÃƒÆ’Ã†â€™Ãƒâ€šÃ‚Â¢ÃƒÆ’Ã‚Â¢ÃƒÂ¢Ã¢â‚¬Å¡Ã‚Â¬Ãƒâ€¦Ã‚Â¡ÃƒÆ’Ã¢â‚¬Å¡Ãƒâ€šÃ‚Â¬ÃƒÆ’Ã†â€™ÃƒÂ¢Ã¢â€šÂ¬Ã‚Â¦ÃƒÆ’Ã¢â‚¬Å¡Ãƒâ€šÃ‚Â¡ÃƒÆ’Ã†â€™Ãƒâ€ Ã¢â‚¬â„¢ÃƒÆ’Ã¢â‚¬Â ÃƒÂ¢Ã¢â€šÂ¬Ã¢â€žÂ¢ÃƒÆ’Ã†â€™Ãƒâ€šÃ‚Â¢ÃƒÆ’Ã‚Â¢ÃƒÂ¢Ã¢â€šÂ¬Ã…Â¡Ãƒâ€šÃ‚Â¬ÃƒÆ’Ã¢â‚¬Â¦Ãƒâ€šÃ‚Â¡ÃƒÆ’Ã†â€™Ãƒâ€ Ã¢â‚¬â„¢ÃƒÆ’Ã‚Â¢ÃƒÂ¢Ã¢â‚¬Å¡Ã‚Â¬Ãƒâ€¦Ã‚Â¡ÃƒÆ’Ã†â€™ÃƒÂ¢Ã¢â€šÂ¬Ã…Â¡ÃƒÆ’Ã¢â‚¬Å¡Ãƒâ€šÃ‚Â¢ÃƒÆ’Ã†â€™Ãƒâ€ Ã¢â‚¬â„¢ÃƒÆ’Ã¢â‚¬Â ÃƒÂ¢Ã¢â€šÂ¬Ã¢â€žÂ¢ÃƒÆ’Ã†â€™ÃƒÂ¢Ã¢â€šÂ¬Ã‚Â ÃƒÆ’Ã‚Â¢ÃƒÂ¢Ã¢â‚¬Å¡Ã‚Â¬ÃƒÂ¢Ã¢â‚¬Å¾Ã‚Â¢ÃƒÆ’Ã†â€™Ãƒâ€ Ã¢â‚¬â„¢ÃƒÆ’Ã‚Â¢ÃƒÂ¢Ã¢â‚¬Å¡Ã‚Â¬Ãƒâ€šÃ‚Â ÃƒÆ’Ã†â€™Ãƒâ€šÃ‚Â¢ÃƒÆ’Ã‚Â¢ÃƒÂ¢Ã¢â€šÂ¬Ã…Â¡Ãƒâ€šÃ‚Â¬ÃƒÆ’Ã‚Â¢ÃƒÂ¢Ã¢â€šÂ¬Ã…Â¾Ãƒâ€šÃ‚Â¢ÃƒÆ’Ã†â€™Ãƒâ€ Ã¢â‚¬â„¢ÃƒÆ’Ã¢â‚¬Â ÃƒÂ¢Ã¢â€šÂ¬Ã¢â€žÂ¢ÃƒÆ’Ã†â€™Ãƒâ€šÃ‚Â¢ÃƒÆ’Ã‚Â¢ÃƒÂ¢Ã¢â€šÂ¬Ã…Â¡Ãƒâ€šÃ‚Â¬ÃƒÆ’Ã¢â‚¬Â¦Ãƒâ€šÃ‚Â¡ÃƒÆ’Ã†â€™Ãƒâ€ Ã¢â‚¬â„¢ÃƒÆ’Ã‚Â¢ÃƒÂ¢Ã¢â‚¬Å¡Ã‚Â¬Ãƒâ€¦Ã‚Â¡ÃƒÆ’Ã†â€™ÃƒÂ¢Ã¢â€šÂ¬Ã…Â¡ÃƒÆ’Ã¢â‚¬Å¡Ãƒâ€šÃ‚Â¢ÃƒÆ’Ã†â€™Ãƒâ€ Ã¢â‚¬â„¢ÃƒÆ’Ã¢â‚¬Â ÃƒÂ¢Ã¢â€šÂ¬Ã¢â€žÂ¢ÃƒÆ’Ã†â€™ÃƒÂ¢Ã¢â€šÂ¬Ã‚Â ÃƒÆ’Ã‚Â¢ÃƒÂ¢Ã¢â‚¬Å¡Ã‚Â¬ÃƒÂ¢Ã¢â‚¬Å¾Ã‚Â¢ÃƒÆ’Ã†â€™Ãƒâ€ Ã¢â‚¬â„¢ÃƒÆ’Ã‚Â¢ÃƒÂ¢Ã¢â‚¬Å¡Ã‚Â¬Ãƒâ€¦Ã‚Â¡ÃƒÆ’Ã†â€™ÃƒÂ¢Ã¢â€šÂ¬Ã…Â¡ÃƒÆ’Ã¢â‚¬Å¡Ãƒâ€šÃ‚Â¢ÃƒÆ’Ã†â€™Ãƒâ€ Ã¢â‚¬â„¢ÃƒÆ’Ã¢â‚¬Â ÃƒÂ¢Ã¢â€šÂ¬Ã¢â€žÂ¢ÃƒÆ’Ã†â€™ÃƒÂ¢Ã¢â€šÂ¬Ã…Â¡ÃƒÆ’Ã¢â‚¬Å¡Ãƒâ€šÃ‚Â¢ÃƒÆ’Ã†â€™Ãƒâ€ Ã¢â‚¬â„¢ÃƒÆ’Ã¢â‚¬Å¡Ãƒâ€šÃ‚Â¢ÃƒÆ’Ã†â€™Ãƒâ€šÃ‚Â¢ÃƒÆ’Ã‚Â¢ÃƒÂ¢Ã¢â‚¬Å¡Ã‚Â¬Ãƒâ€¦Ã‚Â¡ÃƒÆ’Ã¢â‚¬Å¡Ãƒâ€šÃ‚Â¬ÃƒÆ’Ã†â€™ÃƒÂ¢Ã¢â€šÂ¬Ã‚Â¦ÃƒÆ’Ã¢â‚¬Å¡Ãƒâ€šÃ‚Â¡ÃƒÆ’Ã†â€™Ãƒâ€ Ã¢â‚¬â„¢ÃƒÆ’Ã‚Â¢ÃƒÂ¢Ã¢â‚¬Å¡Ã‚Â¬Ãƒâ€¦Ã‚Â¡ÃƒÆ’Ã†â€™ÃƒÂ¢Ã¢â€šÂ¬Ã…Â¡ÃƒÆ’Ã¢â‚¬Å¡Ãƒâ€šÃ‚Â¬ÃƒÆ’Ã†â€™Ãƒâ€ Ã¢â‚¬â„¢ÃƒÆ’Ã¢â‚¬Â ÃƒÂ¢Ã¢â€šÂ¬Ã¢â€žÂ¢ÃƒÆ’Ã†â€™Ãƒâ€šÃ‚Â¢ÃƒÆ’Ã‚Â¢ÃƒÂ¢Ã¢â€šÂ¬Ã…Â¡Ãƒâ€šÃ‚Â¬ÃƒÆ’Ã¢â‚¬Å¡Ãƒâ€šÃ‚Â¦ÃƒÆ’Ã†â€™Ãƒâ€ Ã¢â‚¬â„¢ÃƒÆ’Ã‚Â¢ÃƒÂ¢Ã¢â‚¬Å¡Ã‚Â¬Ãƒâ€¦Ã‚Â¡ÃƒÆ’Ã†â€™ÃƒÂ¢Ã¢â€šÂ¬Ã…Â¡ÃƒÆ’Ã¢â‚¬Å¡Ãƒâ€šÃ‚Â¡ÃƒÆ’Ã†â€™Ãƒâ€ Ã¢â‚¬â„¢ÃƒÆ’Ã¢â‚¬Â ÃƒÂ¢Ã¢â€šÂ¬Ã¢â€žÂ¢ÃƒÆ’Ã†â€™ÃƒÂ¢Ã¢â€šÂ¬Ã‚Â ÃƒÆ’Ã‚Â¢ÃƒÂ¢Ã¢â‚¬Å¡Ã‚Â¬ÃƒÂ¢Ã¢â‚¬Å¾Ã‚Â¢ÃƒÆ’Ã†â€™Ãƒâ€ Ã¢â‚¬â„¢ÃƒÆ’Ã¢â‚¬Å¡Ãƒâ€šÃ‚Â¢ÃƒÆ’Ã†â€™Ãƒâ€šÃ‚Â¢ÃƒÆ’Ã‚Â¢ÃƒÂ¢Ã¢â‚¬Å¡Ã‚Â¬Ãƒâ€¦Ã‚Â¡ÃƒÆ’Ã¢â‚¬Å¡Ãƒâ€šÃ‚Â¬ÃƒÆ’Ã†â€™ÃƒÂ¢Ã¢â€šÂ¬Ã‚Â¦ÃƒÆ’Ã¢â‚¬Å¡Ãƒâ€šÃ‚Â¡ÃƒÆ’Ã†â€™Ãƒâ€ Ã¢â‚¬â„¢ÃƒÆ’Ã¢â‚¬Â ÃƒÂ¢Ã¢â€šÂ¬Ã¢â€žÂ¢ÃƒÆ’Ã†â€™Ãƒâ€šÃ‚Â¢ÃƒÆ’Ã‚Â¢ÃƒÂ¢Ã¢â€šÂ¬Ã…Â¡Ãƒâ€šÃ‚Â¬ÃƒÆ’Ã¢â‚¬Â¦Ãƒâ€šÃ‚Â¡ÃƒÆ’Ã†â€™Ãƒâ€ Ã¢â‚¬â„¢ÃƒÆ’Ã‚Â¢ÃƒÂ¢Ã¢â‚¬Å¡Ã‚Â¬Ãƒâ€¦Ã‚Â¡ÃƒÆ’Ã†â€™ÃƒÂ¢Ã¢â€šÂ¬Ã…Â¡ÃƒÆ’Ã¢â‚¬Å¡Ãƒâ€šÃ‚Â¬ÃƒÆ’Ã†â€™Ãƒâ€ Ã¢â‚¬â„¢ÃƒÆ’Ã¢â‚¬Â ÃƒÂ¢Ã¢â€šÂ¬Ã¢â€žÂ¢ÃƒÆ’Ã†â€™ÃƒÂ¢Ã¢â€šÂ¬Ã‚Â ÃƒÆ’Ã‚Â¢ÃƒÂ¢Ã¢â‚¬Å¡Ã‚Â¬ÃƒÂ¢Ã¢â‚¬Å¾Ã‚Â¢ÃƒÆ’Ã†â€™Ãƒâ€ Ã¢â‚¬â„¢ÃƒÆ’Ã‚Â¢ÃƒÂ¢Ã¢â‚¬Å¡Ã‚Â¬Ãƒâ€šÃ‚Â ÃƒÆ’Ã†â€™Ãƒâ€šÃ‚Â¢ÃƒÆ’Ã‚Â¢ÃƒÂ¢Ã¢â€šÂ¬Ã…Â¡Ãƒâ€šÃ‚Â¬ÃƒÆ’Ã‚Â¢ÃƒÂ¢Ã¢â€šÂ¬Ã…Â¾Ãƒâ€šÃ‚Â¢ÃƒÆ’Ã†â€™Ãƒâ€ Ã¢â‚¬â„¢ÃƒÆ’Ã¢â‚¬Â ÃƒÂ¢Ã¢â€šÂ¬Ã¢â€žÂ¢ÃƒÆ’Ã†â€™ÃƒÂ¢Ã¢â€šÂ¬Ã…Â¡ÃƒÆ’Ã¢â‚¬Å¡Ãƒâ€šÃ‚Â¢ÃƒÆ’Ã†â€™Ãƒâ€ Ã¢â‚¬â„¢ÃƒÆ’Ã¢â‚¬Å¡Ãƒâ€šÃ‚Â¢ÃƒÆ’Ã†â€™Ãƒâ€šÃ‚Â¢ÃƒÆ’Ã‚Â¢ÃƒÂ¢Ã¢â€šÂ¬Ã…Â¡Ãƒâ€šÃ‚Â¬ÃƒÆ’Ã¢â‚¬Â¦Ãƒâ€šÃ‚Â¡ÃƒÆ’Ã†â€™ÃƒÂ¢Ã¢â€šÂ¬Ã…Â¡ÃƒÆ’Ã¢â‚¬Å¡Ãƒâ€šÃ‚Â¬ÃƒÆ’Ã†â€™Ãƒâ€ Ã¢â‚¬â„¢ÃƒÆ’Ã‚Â¢ÃƒÂ¢Ã¢â‚¬Å¡Ã‚Â¬Ãƒâ€¦Ã‚Â¡ÃƒÆ’Ã†â€™ÃƒÂ¢Ã¢â€šÂ¬Ã…Â¡ÃƒÆ’Ã¢â‚¬Å¡Ãƒâ€šÃ‚Â¦ÃƒÆ’Ã†â€™Ãƒâ€ Ã¢â‚¬â„¢ÃƒÆ’Ã¢â‚¬Â ÃƒÂ¢Ã¢â€šÂ¬Ã¢â€žÂ¢ÃƒÆ’Ã†â€™ÃƒÂ¢Ã¢â€šÂ¬Ã‚Â ÃƒÆ’Ã‚Â¢ÃƒÂ¢Ã¢â‚¬Å¡Ã‚Â¬ÃƒÂ¢Ã¢â‚¬Å¾Ã‚Â¢ÃƒÆ’Ã†â€™Ãƒâ€ Ã¢â‚¬â„¢ÃƒÆ’Ã¢â‚¬Å¡Ãƒâ€šÃ‚Â¢ÃƒÆ’Ã†â€™Ãƒâ€šÃ‚Â¢ÃƒÆ’Ã‚Â¢ÃƒÂ¢Ã¢â‚¬Å¡Ã‚Â¬Ãƒâ€¦Ã‚Â¡ÃƒÆ’Ã¢â‚¬Å¡Ãƒâ€šÃ‚Â¬ÃƒÆ’Ã†â€™ÃƒÂ¢Ã¢â€šÂ¬Ã‚Â¦ÃƒÆ’Ã¢â‚¬Å¡Ãƒâ€šÃ‚Â¡ÃƒÆ’Ã†â€™Ãƒâ€ Ã¢â‚¬â„¢ÃƒÆ’Ã¢â‚¬Â ÃƒÂ¢Ã¢â€šÂ¬Ã¢â€žÂ¢ÃƒÆ’Ã†â€™Ãƒâ€šÃ‚Â¢ÃƒÆ’Ã‚Â¢ÃƒÂ¢Ã¢â€šÂ¬Ã…Â¡Ãƒâ€šÃ‚Â¬ÃƒÆ’Ã¢â‚¬Â¦Ãƒâ€šÃ‚Â¡ÃƒÆ’Ã†â€™Ãƒâ€ Ã¢â‚¬â„¢ÃƒÆ’Ã‚Â¢ÃƒÂ¢Ã¢â‚¬Å¡Ã‚Â¬Ãƒâ€¦Ã‚Â¡ÃƒÆ’Ã†â€™ÃƒÂ¢Ã¢â€šÂ¬Ã…Â¡ÃƒÆ’Ã¢â‚¬Å¡Ãƒâ€šÃ‚Â¡ÃƒÆ’Ã†â€™Ãƒâ€ Ã¢â‚¬â„¢ÃƒÆ’Ã¢â‚¬Â ÃƒÂ¢Ã¢â€šÂ¬Ã¢â€žÂ¢ÃƒÆ’Ã†â€™ÃƒÂ¢Ã¢â€šÂ¬Ã‚Â ÃƒÆ’Ã‚Â¢ÃƒÂ¢Ã¢â‚¬Å¡Ã‚Â¬ÃƒÂ¢Ã¢â‚¬Å¾Ã‚Â¢ÃƒÆ’Ã†â€™Ãƒâ€ Ã¢â‚¬â„¢ÃƒÆ’Ã‚Â¢ÃƒÂ¢Ã¢â‚¬Å¡Ã‚Â¬Ãƒâ€šÃ‚Â ÃƒÆ’Ã†â€™Ãƒâ€šÃ‚Â¢ÃƒÆ’Ã‚Â¢ÃƒÂ¢Ã¢â€šÂ¬Ã…Â¡Ãƒâ€šÃ‚Â¬ÃƒÆ’Ã‚Â¢ÃƒÂ¢Ã¢â€šÂ¬Ã…Â¾Ãƒâ€šÃ‚Â¢ÃƒÆ’Ã†â€™Ãƒâ€ Ã¢â‚¬â„¢ÃƒÆ’Ã¢â‚¬Â ÃƒÂ¢Ã¢â€šÂ¬Ã¢â€žÂ¢ÃƒÆ’Ã†â€™Ãƒâ€šÃ‚Â¢ÃƒÆ’Ã‚Â¢ÃƒÂ¢Ã¢â€šÂ¬Ã…Â¡Ãƒâ€šÃ‚Â¬ÃƒÆ’Ã¢â‚¬Å¡Ãƒâ€šÃ‚Â ÃƒÆ’Ã†â€™Ãƒâ€ Ã¢â‚¬â„¢ÃƒÆ’Ã¢â‚¬Å¡Ãƒâ€šÃ‚Â¢ÃƒÆ’Ã†â€™Ãƒâ€šÃ‚Â¢ÃƒÆ’Ã‚Â¢ÃƒÂ¢Ã¢â‚¬Å¡Ã‚Â¬Ãƒâ€¦Ã‚Â¡ÃƒÆ’Ã¢â‚¬Å¡Ãƒâ€šÃ‚Â¬ÃƒÆ’Ã†â€™Ãƒâ€šÃ‚Â¢ÃƒÆ’Ã‚Â¢ÃƒÂ¢Ã¢â‚¬Å¡Ã‚Â¬Ãƒâ€¦Ã‚Â¾ÃƒÆ’Ã¢â‚¬Å¡Ãƒâ€šÃ‚Â¢ÃƒÆ’Ã†â€™Ãƒâ€ Ã¢â‚¬â„¢ÃƒÆ’Ã¢â‚¬Â ÃƒÂ¢Ã¢â€šÂ¬Ã¢â€žÂ¢ÃƒÆ’Ã†â€™ÃƒÂ¢Ã¢â€šÂ¬Ã‚Â ÃƒÆ’Ã‚Â¢ÃƒÂ¢Ã¢â‚¬Å¡Ã‚Â¬ÃƒÂ¢Ã¢â‚¬Å¾Ã‚Â¢ÃƒÆ’Ã†â€™Ãƒâ€ Ã¢â‚¬â„¢ÃƒÆ’Ã¢â‚¬Å¡Ãƒâ€šÃ‚Â¢ÃƒÆ’Ã†â€™Ãƒâ€šÃ‚Â¢ÃƒÆ’Ã‚Â¢ÃƒÂ¢Ã¢â‚¬Å¡Ã‚Â¬Ãƒâ€¦Ã‚Â¡ÃƒÆ’Ã¢â‚¬Å¡Ãƒâ€šÃ‚Â¬ÃƒÆ’Ã†â€™ÃƒÂ¢Ã¢â€šÂ¬Ã…Â¡ÃƒÆ’Ã¢â‚¬Å¡Ãƒâ€šÃ‚Â ÃƒÆ’Ã†â€™Ãƒâ€ Ã¢â‚¬â„¢ÃƒÆ’Ã¢â‚¬Â ÃƒÂ¢Ã¢â€šÂ¬Ã¢â€žÂ¢ÃƒÆ’Ã†â€™ÃƒÂ¢Ã¢â€šÂ¬Ã…Â¡ÃƒÆ’Ã¢â‚¬Å¡Ãƒâ€šÃ‚Â¢ÃƒÆ’Ã†â€™Ãƒâ€ Ã¢â‚¬â„¢ÃƒÆ’Ã¢â‚¬Å¡Ãƒâ€šÃ‚Â¢ÃƒÆ’Ã†â€™Ãƒâ€šÃ‚Â¢ÃƒÆ’Ã‚Â¢ÃƒÂ¢Ã¢â€šÂ¬Ã…Â¡Ãƒâ€šÃ‚Â¬ÃƒÆ’Ã¢â‚¬Â¦Ãƒâ€šÃ‚Â¡ÃƒÆ’Ã†â€™ÃƒÂ¢Ã¢â€šÂ¬Ã…Â¡ÃƒÆ’Ã¢â‚¬Å¡Ãƒâ€šÃ‚Â¬ÃƒÆ’Ã†â€™Ãƒâ€ Ã¢â‚¬â„¢ÃƒÆ’Ã¢â‚¬Å¡Ãƒâ€šÃ‚Â¢ÃƒÆ’Ã†â€™Ãƒâ€šÃ‚Â¢ÃƒÆ’Ã‚Â¢ÃƒÂ¢Ã¢â€šÂ¬Ã…Â¡Ãƒâ€šÃ‚Â¬ÃƒÆ’Ã¢â‚¬Â¦Ãƒâ€šÃ‚Â¾ÃƒÆ’Ã†â€™ÃƒÂ¢Ã¢â€šÂ¬Ã…Â¡ÃƒÆ’Ã¢â‚¬Å¡Ãƒâ€šÃ‚Â¢ÃƒÆ’Ã†â€™Ãƒâ€ Ã¢â‚¬â„¢ÃƒÆ’Ã¢â‚¬Â ÃƒÂ¢Ã¢â€šÂ¬Ã¢â€žÂ¢ÃƒÆ’Ã†â€™ÃƒÂ¢Ã¢â€šÂ¬Ã‚Â ÃƒÆ’Ã‚Â¢ÃƒÂ¢Ã¢â‚¬Å¡Ã‚Â¬ÃƒÂ¢Ã¢â‚¬Å¾Ã‚Â¢ÃƒÆ’Ã†â€™Ãƒâ€ Ã¢â‚¬â„¢ÃƒÆ’Ã‚Â¢ÃƒÂ¢Ã¢â‚¬Å¡Ã‚Â¬Ãƒâ€šÃ‚Â ÃƒÆ’Ã†â€™Ãƒâ€šÃ‚Â¢ÃƒÆ’Ã‚Â¢ÃƒÂ¢Ã¢â€šÂ¬Ã…Â¡Ãƒâ€šÃ‚Â¬ÃƒÆ’Ã‚Â¢ÃƒÂ¢Ã¢â€šÂ¬Ã…Â¾Ãƒâ€šÃ‚Â¢ÃƒÆ’Ã†â€™Ãƒâ€ Ã¢â‚¬â„¢ÃƒÆ’Ã¢â‚¬Â ÃƒÂ¢Ã¢â€šÂ¬Ã¢â€žÂ¢ÃƒÆ’Ã†â€™ÃƒÂ¢Ã¢â€šÂ¬Ã…Â¡ÃƒÆ’Ã¢â‚¬Å¡Ãƒâ€šÃ‚Â¢ÃƒÆ’Ã†â€™Ãƒâ€ Ã¢â‚¬â„¢ÃƒÆ’Ã¢â‚¬Å¡Ãƒâ€šÃ‚Â¢ÃƒÆ’Ã†â€™Ãƒâ€šÃ‚Â¢ÃƒÆ’Ã‚Â¢ÃƒÂ¢Ã¢â€šÂ¬Ã…Â¡Ãƒâ€šÃ‚Â¬ÃƒÆ’Ã¢â‚¬Â¦Ãƒâ€šÃ‚Â¡ÃƒÆ’Ã†â€™ÃƒÂ¢Ã¢â€šÂ¬Ã…Â¡ÃƒÆ’Ã¢â‚¬Å¡Ãƒâ€šÃ‚Â¬ÃƒÆ’Ã†â€™Ãƒâ€ Ã¢â‚¬â„¢ÃƒÆ’Ã‚Â¢ÃƒÂ¢Ã¢â‚¬Å¡Ã‚Â¬Ãƒâ€šÃ‚Â¦ÃƒÆ’Ã†â€™ÃƒÂ¢Ã¢â€šÂ¬Ã…Â¡ÃƒÆ’Ã¢â‚¬Å¡Ãƒâ€šÃ‚Â¡ÃƒÆ’Ã†â€™Ãƒâ€ Ã¢â‚¬â„¢ÃƒÆ’Ã¢â‚¬Â ÃƒÂ¢Ã¢â€šÂ¬Ã¢â€žÂ¢ÃƒÆ’Ã†â€™ÃƒÂ¢Ã¢â€šÂ¬Ã‚Â ÃƒÆ’Ã‚Â¢ÃƒÂ¢Ã¢â‚¬Å¡Ã‚Â¬ÃƒÂ¢Ã¢â‚¬Å¾Ã‚Â¢ÃƒÆ’Ã†â€™Ãƒâ€ Ã¢â‚¬â„¢ÃƒÆ’Ã¢â‚¬Å¡Ãƒâ€šÃ‚Â¢ÃƒÆ’Ã†â€™Ãƒâ€šÃ‚Â¢ÃƒÆ’Ã‚Â¢ÃƒÂ¢Ã¢â‚¬Å¡Ã‚Â¬Ãƒâ€¦Ã‚Â¡ÃƒÆ’Ã¢â‚¬Å¡Ãƒâ€šÃ‚Â¬ÃƒÆ’Ã†â€™ÃƒÂ¢Ã¢â€šÂ¬Ã‚Â¦ÃƒÆ’Ã¢â‚¬Å¡Ãƒâ€šÃ‚Â¡ÃƒÆ’Ã†â€™Ãƒâ€ Ã¢â‚¬â„¢ÃƒÆ’Ã¢â‚¬Â ÃƒÂ¢Ã¢â€šÂ¬Ã¢â€žÂ¢ÃƒÆ’Ã†â€™Ãƒâ€šÃ‚Â¢ÃƒÆ’Ã‚Â¢ÃƒÂ¢Ã¢â€šÂ¬Ã…Â¡Ãƒâ€šÃ‚Â¬ÃƒÆ’Ã¢â‚¬Â¦Ãƒâ€šÃ‚Â¡ÃƒÆ’Ã†â€™Ãƒâ€ Ã¢â‚¬â„¢ÃƒÆ’Ã‚Â¢ÃƒÂ¢Ã¢â‚¬Å¡Ã‚Â¬Ãƒâ€¦Ã‚Â¡ÃƒÆ’Ã†â€™ÃƒÂ¢Ã¢â€šÂ¬Ã…Â¡ÃƒÆ’Ã¢â‚¬Å¡Ãƒâ€šÃ‚Â¢ÃƒÆ’Ã†â€™Ãƒâ€ Ã¢â‚¬â„¢ÃƒÆ’Ã¢â‚¬Â ÃƒÂ¢Ã¢â€šÂ¬Ã¢â€žÂ¢ÃƒÆ’Ã†â€™ÃƒÂ¢Ã¢â€šÂ¬Ã‚Â ÃƒÆ’Ã‚Â¢ÃƒÂ¢Ã¢â‚¬Å¡Ã‚Â¬ÃƒÂ¢Ã¢â‚¬Å¾Ã‚Â¢ÃƒÆ’Ã†â€™Ãƒâ€ Ã¢â‚¬â„¢ÃƒÆ’Ã‚Â¢ÃƒÂ¢Ã¢â‚¬Å¡Ã‚Â¬Ãƒâ€šÃ‚Â ÃƒÆ’Ã†â€™Ãƒâ€šÃ‚Â¢ÃƒÆ’Ã‚Â¢ÃƒÂ¢Ã¢â€šÂ¬Ã…Â¡Ãƒâ€šÃ‚Â¬ÃƒÆ’Ã‚Â¢ÃƒÂ¢Ã¢â€šÂ¬Ã…Â¾Ãƒâ€šÃ‚Â¢ÃƒÆ’Ã†â€™Ãƒâ€ Ã¢â‚¬â„¢ÃƒÆ’Ã¢â‚¬Â ÃƒÂ¢Ã¢â€šÂ¬Ã¢â€žÂ¢ÃƒÆ’Ã†â€™Ãƒâ€šÃ‚Â¢ÃƒÆ’Ã‚Â¢ÃƒÂ¢Ã¢â€šÂ¬Ã…Â¡Ãƒâ€šÃ‚Â¬ÃƒÆ’Ã¢â‚¬Å¡Ãƒâ€šÃ‚Â ÃƒÆ’Ã†â€™Ãƒâ€ Ã¢â‚¬â„¢ÃƒÆ’Ã¢â‚¬Å¡Ãƒâ€šÃ‚Â¢ÃƒÆ’Ã†â€™Ãƒâ€šÃ‚Â¢ÃƒÆ’Ã‚Â¢ÃƒÂ¢Ã¢â‚¬Å¡Ã‚Â¬Ãƒâ€¦Ã‚Â¡ÃƒÆ’Ã¢â‚¬Å¡Ãƒâ€šÃ‚Â¬ÃƒÆ’Ã†â€™Ãƒâ€šÃ‚Â¢ÃƒÆ’Ã‚Â¢ÃƒÂ¢Ã¢â‚¬Å¡Ã‚Â¬Ãƒâ€¦Ã‚Â¾ÃƒÆ’Ã¢â‚¬Å¡Ãƒâ€šÃ‚Â¢ÃƒÆ’Ã†â€™Ãƒâ€ Ã¢â‚¬â„¢ÃƒÆ’Ã¢â‚¬Â ÃƒÂ¢Ã¢â€šÂ¬Ã¢â€žÂ¢ÃƒÆ’Ã†â€™ÃƒÂ¢Ã¢â€šÂ¬Ã‚Â ÃƒÆ’Ã‚Â¢ÃƒÂ¢Ã¢â‚¬Å¡Ã‚Â¬ÃƒÂ¢Ã¢â‚¬Å¾Ã‚Â¢ÃƒÆ’Ã†â€™Ãƒâ€ Ã¢â‚¬â„¢ÃƒÆ’Ã‚Â¢ÃƒÂ¢Ã¢â‚¬Å¡Ã‚Â¬Ãƒâ€¦Ã‚Â¡ÃƒÆ’Ã†â€™ÃƒÂ¢Ã¢â€šÂ¬Ã…Â¡ÃƒÆ’Ã¢â‚¬Å¡Ãƒâ€šÃ‚Â¢ÃƒÆ’Ã†â€™Ãƒâ€ Ã¢â‚¬â„¢ÃƒÆ’Ã¢â‚¬Â ÃƒÂ¢Ã¢â€šÂ¬Ã¢â€žÂ¢ÃƒÆ’Ã†â€™ÃƒÂ¢Ã¢â€šÂ¬Ã…Â¡ÃƒÆ’Ã¢â‚¬Å¡Ãƒâ€šÃ‚Â¢ÃƒÆ’Ã†â€™Ãƒâ€ Ã¢â‚¬â„¢ÃƒÆ’Ã¢â‚¬Å¡Ãƒâ€šÃ‚Â¢ÃƒÆ’Ã†â€™Ãƒâ€šÃ‚Â¢ÃƒÆ’Ã‚Â¢ÃƒÂ¢Ã¢â‚¬Å¡Ã‚Â¬Ãƒâ€¦Ã‚Â¡ÃƒÆ’Ã¢â‚¬Å¡Ãƒâ€šÃ‚Â¬ÃƒÆ’Ã†â€™ÃƒÂ¢Ã¢â€šÂ¬Ã‚Â¦ÃƒÆ’Ã¢â‚¬Å¡Ãƒâ€šÃ‚Â¡ÃƒÆ’Ã†â€™Ãƒâ€ Ã¢â‚¬â„¢ÃƒÆ’Ã‚Â¢ÃƒÂ¢Ã¢â‚¬Å¡Ã‚Â¬Ãƒâ€¦Ã‚Â¡ÃƒÆ’Ã†â€™ÃƒÂ¢Ã¢â€šÂ¬Ã…Â¡ÃƒÆ’Ã¢â‚¬Å¡Ãƒâ€šÃ‚Â¬ÃƒÆ’Ã†â€™Ãƒâ€ Ã¢â‚¬â„¢ÃƒÆ’Ã¢â‚¬Â ÃƒÂ¢Ã¢â€šÂ¬Ã¢â€žÂ¢ÃƒÆ’Ã†â€™Ãƒâ€šÃ‚Â¢ÃƒÆ’Ã‚Â¢ÃƒÂ¢Ã¢â€šÂ¬Ã…Â¡Ãƒâ€šÃ‚Â¬ÃƒÆ’Ã¢â‚¬Å¡Ãƒâ€šÃ‚Â¦ÃƒÆ’Ã†â€™Ãƒâ€ Ã¢â‚¬â„¢ÃƒÆ’Ã‚Â¢ÃƒÂ¢Ã¢â‚¬Å¡Ã‚Â¬Ãƒâ€¦Ã‚Â¡ÃƒÆ’Ã†â€™ÃƒÂ¢Ã¢â€šÂ¬Ã…Â¡ÃƒÆ’Ã¢â‚¬Å¡Ãƒâ€šÃ‚Â¡ÃƒÆ’Ã†â€™Ãƒâ€ Ã¢â‚¬â„¢ÃƒÆ’Ã¢â‚¬Â ÃƒÂ¢Ã¢â€šÂ¬Ã¢â€žÂ¢ÃƒÆ’Ã†â€™ÃƒÂ¢Ã¢â€šÂ¬Ã‚Â ÃƒÆ’Ã‚Â¢ÃƒÂ¢Ã¢â‚¬Å¡Ã‚Â¬ÃƒÂ¢Ã¢â‚¬Å¾Ã‚Â¢ÃƒÆ’Ã†â€™Ãƒâ€ Ã¢â‚¬â„¢ÃƒÆ’Ã‚Â¢ÃƒÂ¢Ã¢â‚¬Å¡Ã‚Â¬Ãƒâ€šÃ‚Â ÃƒÆ’Ã†â€™Ãƒâ€šÃ‚Â¢ÃƒÆ’Ã‚Â¢ÃƒÂ¢Ã¢â€šÂ¬Ã…Â¡Ãƒâ€šÃ‚Â¬ÃƒÆ’Ã‚Â¢ÃƒÂ¢Ã¢â€šÂ¬Ã…Â¾Ãƒâ€šÃ‚Â¢ÃƒÆ’Ã†â€™Ãƒâ€ Ã¢â‚¬â„¢ÃƒÆ’Ã¢â‚¬Â ÃƒÂ¢Ã¢â€šÂ¬Ã¢â€žÂ¢ÃƒÆ’Ã†â€™ÃƒÂ¢Ã¢â€šÂ¬Ã…Â¡ÃƒÆ’Ã¢â‚¬Å¡Ãƒâ€šÃ‚Â¢ÃƒÆ’Ã†â€™Ãƒâ€ Ã¢â‚¬â„¢ÃƒÆ’Ã¢â‚¬Å¡Ãƒâ€šÃ‚Â¢ÃƒÆ’Ã†â€™Ãƒâ€šÃ‚Â¢ÃƒÆ’Ã‚Â¢ÃƒÂ¢Ã¢â€šÂ¬Ã…Â¡Ãƒâ€šÃ‚Â¬ÃƒÆ’Ã¢â‚¬Â¦Ãƒâ€šÃ‚Â¡ÃƒÆ’Ã†â€™ÃƒÂ¢Ã¢â€šÂ¬Ã…Â¡ÃƒÆ’Ã¢â‚¬Å¡Ãƒâ€šÃ‚Â¬ÃƒÆ’Ã†â€™Ãƒâ€ Ã¢â‚¬â„¢ÃƒÆ’Ã‚Â¢ÃƒÂ¢Ã¢â‚¬Å¡Ã‚Â¬Ãƒâ€šÃ‚Â¦ÃƒÆ’Ã†â€™ÃƒÂ¢Ã¢â€šÂ¬Ã…Â¡ÃƒÆ’Ã¢â‚¬Å¡Ãƒâ€šÃ‚Â¡ÃƒÆ’Ã†â€™Ãƒâ€ Ã¢â‚¬â„¢ÃƒÆ’Ã¢â‚¬Â ÃƒÂ¢Ã¢â€šÂ¬Ã¢â€žÂ¢ÃƒÆ’Ã†â€™ÃƒÂ¢Ã¢â€šÂ¬Ã‚Â ÃƒÆ’Ã‚Â¢ÃƒÂ¢Ã¢â‚¬Å¡Ã‚Â¬ÃƒÂ¢Ã¢â‚¬Å¾Ã‚Â¢ÃƒÆ’Ã†â€™Ãƒâ€ Ã¢â‚¬â„¢ÃƒÆ’Ã¢â‚¬Å¡Ãƒâ€šÃ‚Â¢ÃƒÆ’Ã†â€™Ãƒâ€šÃ‚Â¢ÃƒÆ’Ã‚Â¢ÃƒÂ¢Ã¢â‚¬Å¡Ã‚Â¬Ãƒâ€¦Ã‚Â¡ÃƒÆ’Ã¢â‚¬Å¡Ãƒâ€šÃ‚Â¬ÃƒÆ’Ã†â€™ÃƒÂ¢Ã¢â€šÂ¬Ã‚Â¦ÃƒÆ’Ã¢â‚¬Å¡Ãƒâ€šÃ‚Â¡ÃƒÆ’Ã†â€™Ãƒâ€ Ã¢â‚¬â„¢ÃƒÆ’Ã¢â‚¬Â ÃƒÂ¢Ã¢â€šÂ¬Ã¢â€žÂ¢ÃƒÆ’Ã†â€™Ãƒâ€šÃ‚Â¢ÃƒÆ’Ã‚Â¢ÃƒÂ¢Ã¢â€šÂ¬Ã…Â¡Ãƒâ€šÃ‚Â¬ÃƒÆ’Ã¢â‚¬Â¦Ãƒâ€šÃ‚Â¡ÃƒÆ’Ã†â€™Ãƒâ€ Ã¢â‚¬â„¢ÃƒÆ’Ã‚Â¢ÃƒÂ¢Ã¢â‚¬Å¡Ã‚Â¬Ãƒâ€¦Ã‚Â¡ÃƒÆ’Ã†â€™ÃƒÂ¢Ã¢â€šÂ¬Ã…Â¡ÃƒÆ’Ã¢â‚¬Å¡Ãƒâ€šÃ‚ÂÃƒÆ’Ã†â€™Ãƒâ€ Ã¢â‚¬â„¢ÃƒÆ’Ã¢â‚¬Â ÃƒÂ¢Ã¢â€šÂ¬Ã¢â€žÂ¢ÃƒÆ’Ã†â€™ÃƒÂ¢Ã¢â€šÂ¬Ã‚Â ÃƒÆ’Ã‚Â¢ÃƒÂ¢Ã¢â‚¬Å¡Ã‚Â¬ÃƒÂ¢Ã¢â‚¬Å¾Ã‚Â¢ÃƒÆ’Ã†â€™Ãƒâ€ Ã¢â‚¬â„¢ÃƒÆ’Ã‚Â¢ÃƒÂ¢Ã¢â‚¬Å¡Ã‚Â¬Ãƒâ€šÃ‚Â ÃƒÆ’Ã†â€™Ãƒâ€šÃ‚Â¢ÃƒÆ’Ã‚Â¢ÃƒÂ¢Ã¢â€šÂ¬Ã…Â¡Ãƒâ€šÃ‚Â¬ÃƒÆ’Ã‚Â¢ÃƒÂ¢Ã¢â€šÂ¬Ã…Â¾Ãƒâ€šÃ‚Â¢ÃƒÆ’Ã†â€™Ãƒâ€ Ã¢â‚¬â„¢ÃƒÆ’Ã¢â‚¬Â ÃƒÂ¢Ã¢â€šÂ¬Ã¢â€žÂ¢ÃƒÆ’Ã†â€™Ãƒâ€šÃ‚Â¢ÃƒÆ’Ã‚Â¢ÃƒÂ¢Ã¢â€šÂ¬Ã…Â¡Ãƒâ€šÃ‚Â¬ÃƒÆ’Ã¢â‚¬Å¡Ãƒâ€šÃ‚Â ÃƒÆ’Ã†â€™Ãƒâ€ Ã¢â‚¬â„¢ÃƒÆ’Ã¢â‚¬Å¡Ãƒâ€šÃ‚Â¢ÃƒÆ’Ã†â€™Ãƒâ€šÃ‚Â¢ÃƒÆ’Ã‚Â¢ÃƒÂ¢Ã¢â‚¬Å¡Ã‚Â¬Ãƒâ€¦Ã‚Â¡ÃƒÆ’Ã¢â‚¬Å¡Ãƒâ€šÃ‚Â¬ÃƒÆ’Ã†â€™Ãƒâ€šÃ‚Â¢ÃƒÆ’Ã‚Â¢ÃƒÂ¢Ã¢â‚¬Å¡Ã‚Â¬Ãƒâ€¦Ã‚Â¾ÃƒÆ’Ã¢â‚¬Å¡Ãƒâ€šÃ‚Â¢ÃƒÆ’Ã†â€™Ãƒâ€ Ã¢â‚¬â„¢ÃƒÆ’Ã¢â‚¬Â ÃƒÂ¢Ã¢â€šÂ¬Ã¢â€žÂ¢ÃƒÆ’Ã†â€™ÃƒÂ¢Ã¢â€šÂ¬Ã‚Â ÃƒÆ’Ã‚Â¢ÃƒÂ¢Ã¢â‚¬Å¡Ã‚Â¬ÃƒÂ¢Ã¢â‚¬Å¾Ã‚Â¢ÃƒÆ’Ã†â€™Ãƒâ€ Ã¢â‚¬â„¢ÃƒÆ’Ã‚Â¢ÃƒÂ¢Ã¢â‚¬Å¡Ã‚Â¬Ãƒâ€¦Ã‚Â¡ÃƒÆ’Ã†â€™ÃƒÂ¢Ã¢â€šÂ¬Ã…Â¡ÃƒÆ’Ã¢â‚¬Å¡Ãƒâ€šÃ‚Â¢ÃƒÆ’Ã†â€™Ãƒâ€ Ã¢â‚¬â„¢ÃƒÆ’Ã¢â‚¬Â ÃƒÂ¢Ã¢â€šÂ¬Ã¢â€žÂ¢ÃƒÆ’Ã†â€™ÃƒÂ¢Ã¢â€šÂ¬Ã…Â¡ÃƒÆ’Ã¢â‚¬Å¡Ãƒâ€šÃ‚Â¢ÃƒÆ’Ã†â€™Ãƒâ€ Ã¢â‚¬â„¢ÃƒÆ’Ã¢â‚¬Å¡Ãƒâ€šÃ‚Â¢ÃƒÆ’Ã†â€™Ãƒâ€šÃ‚Â¢ÃƒÆ’Ã‚Â¢ÃƒÂ¢Ã¢â‚¬Å¡Ã‚Â¬Ãƒâ€¦Ã‚Â¡ÃƒÆ’Ã¢â‚¬Å¡Ãƒâ€šÃ‚Â¬ÃƒÆ’Ã†â€™ÃƒÂ¢Ã¢â€šÂ¬Ã‚Â¦ÃƒÆ’Ã¢â‚¬Å¡Ãƒâ€šÃ‚Â¡ÃƒÆ’Ã†â€™Ãƒâ€ Ã¢â‚¬â„¢ÃƒÆ’Ã‚Â¢ÃƒÂ¢Ã¢â‚¬Å¡Ã‚Â¬Ãƒâ€¦Ã‚Â¡ÃƒÆ’Ã†â€™ÃƒÂ¢Ã¢â€šÂ¬Ã…Â¡ÃƒÆ’Ã¢â‚¬Å¡Ãƒâ€šÃ‚Â¬ÃƒÆ’Ã†â€™Ãƒâ€ Ã¢â‚¬â„¢ÃƒÆ’Ã¢â‚¬Â ÃƒÂ¢Ã¢â€šÂ¬Ã¢â€žÂ¢ÃƒÆ’Ã†â€™Ãƒâ€šÃ‚Â¢ÃƒÆ’Ã‚Â¢ÃƒÂ¢Ã¢â€šÂ¬Ã…Â¡Ãƒâ€šÃ‚Â¬ÃƒÆ’Ã¢â‚¬Å¡Ãƒâ€šÃ‚Â¦ÃƒÆ’Ã†â€™Ãƒâ€ Ã¢â‚¬â„¢ÃƒÆ’Ã‚Â¢ÃƒÂ¢Ã¢â‚¬Å¡Ã‚Â¬Ãƒâ€¦Ã‚Â¡ÃƒÆ’Ã†â€™ÃƒÂ¢Ã¢â€šÂ¬Ã…Â¡ÃƒÆ’Ã¢â‚¬Å¡Ãƒâ€šÃ‚Â¡ÃƒÆ’Ã†â€™Ãƒâ€ Ã¢â‚¬â„¢ÃƒÆ’Ã¢â‚¬Â ÃƒÂ¢Ã¢â€šÂ¬Ã¢â€žÂ¢ÃƒÆ’Ã†â€™ÃƒÂ¢Ã¢â€šÂ¬Ã‚Â ÃƒÆ’Ã‚Â¢ÃƒÂ¢Ã¢â‚¬Å¡Ã‚Â¬ÃƒÂ¢Ã¢â‚¬Å¾Ã‚Â¢ÃƒÆ’Ã†â€™Ãƒâ€ Ã¢â‚¬â„¢ÃƒÆ’Ã‚Â¢ÃƒÂ¢Ã¢â‚¬Å¡Ã‚Â¬Ãƒâ€šÃ‚Â ÃƒÆ’Ã†â€™Ãƒâ€šÃ‚Â¢ÃƒÆ’Ã‚Â¢ÃƒÂ¢Ã¢â€šÂ¬Ã…Â¡Ãƒâ€šÃ‚Â¬ÃƒÆ’Ã‚Â¢ÃƒÂ¢Ã¢â€šÂ¬Ã…Â¾Ãƒâ€šÃ‚Â¢ÃƒÆ’Ã†â€™Ãƒâ€ Ã¢â‚¬â„¢ÃƒÆ’Ã¢â‚¬Â ÃƒÂ¢Ã¢â€šÂ¬Ã¢â€žÂ¢ÃƒÆ’Ã†â€™ÃƒÂ¢Ã¢â€šÂ¬Ã…Â¡ÃƒÆ’Ã¢â‚¬Å¡Ãƒâ€šÃ‚Â¢ÃƒÆ’Ã†â€™Ãƒâ€ Ã¢â‚¬â„¢ÃƒÆ’Ã¢â‚¬Å¡Ãƒâ€šÃ‚Â¢ÃƒÆ’Ã†â€™Ãƒâ€šÃ‚Â¢ÃƒÆ’Ã‚Â¢ÃƒÂ¢Ã¢â€šÂ¬Ã…Â¡Ãƒâ€šÃ‚Â¬ÃƒÆ’Ã¢â‚¬Â¦Ãƒâ€šÃ‚Â¡ÃƒÆ’Ã†â€™ÃƒÂ¢Ã¢â€šÂ¬Ã…Â¡ÃƒÆ’Ã¢â‚¬Å¡Ãƒâ€šÃ‚Â¬ÃƒÆ’Ã†â€™Ãƒâ€ Ã¢â‚¬â„¢ÃƒÆ’Ã‚Â¢ÃƒÂ¢Ã¢â‚¬Å¡Ã‚Â¬Ãƒâ€šÃ‚Â¦ÃƒÆ’Ã†â€™ÃƒÂ¢Ã¢â€šÂ¬Ã…Â¡ÃƒÆ’Ã¢â‚¬Å¡Ãƒâ€šÃ‚Â¡ÃƒÆ’Ã†â€™Ãƒâ€ Ã¢â‚¬â„¢ÃƒÆ’Ã¢â‚¬Â ÃƒÂ¢Ã¢â€šÂ¬Ã¢â€žÂ¢ÃƒÆ’Ã†â€™ÃƒÂ¢Ã¢â€šÂ¬Ã‚Â ÃƒÆ’Ã‚Â¢ÃƒÂ¢Ã¢â‚¬Å¡Ã‚Â¬ÃƒÂ¢Ã¢â‚¬Å¾Ã‚Â¢ÃƒÆ’Ã†â€™Ãƒâ€ Ã¢â‚¬â„¢ÃƒÆ’Ã¢â‚¬Å¡Ãƒâ€šÃ‚Â¢ÃƒÆ’Ã†â€™Ãƒâ€šÃ‚Â¢ÃƒÆ’Ã‚Â¢ÃƒÂ¢Ã¢â‚¬Å¡Ã‚Â¬Ãƒâ€¦Ã‚Â¡ÃƒÆ’Ã¢â‚¬Å¡Ãƒâ€šÃ‚Â¬ÃƒÆ’Ã†â€™ÃƒÂ¢Ã¢â€šÂ¬Ã‚Â¦ÃƒÆ’Ã¢â‚¬Å¡Ãƒâ€šÃ‚Â¡ÃƒÆ’Ã†â€™Ãƒâ€ Ã¢â‚¬â„¢ÃƒÆ’Ã¢â‚¬Â ÃƒÂ¢Ã¢â€šÂ¬Ã¢â€žÂ¢ÃƒÆ’Ã†â€™Ãƒâ€šÃ‚Â¢ÃƒÆ’Ã‚Â¢ÃƒÂ¢Ã¢â€šÂ¬Ã…Â¡Ãƒâ€šÃ‚Â¬ÃƒÆ’Ã¢â‚¬Â¦Ãƒâ€šÃ‚Â¡ÃƒÆ’Ã†â€™Ãƒâ€ Ã¢â‚¬â„¢ÃƒÆ’Ã‚Â¢ÃƒÂ¢Ã¢â‚¬Å¡Ã‚Â¬Ãƒâ€¦Ã‚Â¡ÃƒÆ’Ã†â€™ÃƒÂ¢Ã¢â€šÂ¬Ã…Â¡ÃƒÆ’Ã¢â‚¬Å¡Ãƒâ€šÃ‚Â»-N) concentration (</w:t>
       </w:r>
       <w:proofErr w:type="spellStart"/>
       <w:r>
@@ -8560,7 +8560,7 @@
           <w:sz w:val="28"/>
           <w:szCs w:val="28"/>
         </w:rPr>
-        <w:t>ÃƒÆ’Ã†â€™Ãƒâ€ Ã¢â‚¬â„¢ÃƒÆ’Ã¢â‚¬Â ÃƒÂ¢Ã¢â€šÂ¬Ã¢â€žÂ¢ÃƒÆ’Ã†â€™ÃƒÂ¢Ã¢â€šÂ¬Ã‚Â ÃƒÆ’Ã‚Â¢ÃƒÂ¢Ã¢â‚¬Å¡Ã‚Â¬ÃƒÂ¢Ã¢â‚¬Å¾Ã‚Â¢ÃƒÆ’Ã†â€™Ãƒâ€ Ã¢â‚¬â„¢ÃƒÆ’Ã‚Â¢ÃƒÂ¢Ã¢â‚¬Å¡Ã‚Â¬Ãƒâ€šÃ‚Â ÃƒÆ’Ã†â€™Ãƒâ€šÃ‚Â¢ÃƒÆ’Ã‚Â¢ÃƒÂ¢Ã¢â€šÂ¬Ã…Â¡Ãƒâ€šÃ‚Â¬ÃƒÆ’Ã‚Â¢ÃƒÂ¢Ã¢â€šÂ¬Ã…Â¾Ãƒâ€šÃ‚Â¢ÃƒÆ’Ã†â€™Ãƒâ€ Ã¢â‚¬â„¢ÃƒÆ’Ã¢â‚¬Â ÃƒÂ¢Ã¢â€šÂ¬Ã¢â€žÂ¢ÃƒÆ’Ã†â€™Ãƒâ€šÃ‚Â¢ÃƒÆ’Ã‚Â¢ÃƒÂ¢Ã¢â€šÂ¬Ã…Â¡Ãƒâ€šÃ‚Â¬ÃƒÆ’Ã¢â‚¬Å¡Ãƒâ€šÃ‚Â ÃƒÆ’Ã†â€™Ãƒâ€ Ã¢â‚¬â„¢ÃƒÆ’Ã¢â‚¬Å¡Ãƒâ€šÃ‚Â¢ÃƒÆ’Ã†â€™Ãƒâ€šÃ‚Â¢ÃƒÆ’Ã‚Â¢ÃƒÂ¢Ã¢â‚¬Å¡Ã‚Â¬Ãƒâ€¦Ã‚Â¡ÃƒÆ’Ã¢â‚¬Å¡Ãƒâ€šÃ‚Â¬ÃƒÆ’Ã†â€™Ãƒâ€šÃ‚Â¢ÃƒÆ’Ã‚Â¢ÃƒÂ¢Ã¢â‚¬Å¡Ã‚Â¬Ãƒâ€¦Ã‚Â¾ÃƒÆ’Ã¢â‚¬Å¡Ãƒâ€šÃ‚Â¢ÃƒÆ’Ã†â€™Ãƒâ€ Ã¢â‚¬â„¢ÃƒÆ’Ã¢â‚¬Â ÃƒÂ¢Ã¢â€šÂ¬Ã¢â€žÂ¢ÃƒÆ’Ã†â€™ÃƒÂ¢Ã¢â€šÂ¬Ã‚Â ÃƒÆ’Ã‚Â¢ÃƒÂ¢Ã¢â‚¬Å¡Ã‚Â¬ÃƒÂ¢Ã¢â‚¬Å¾Ã‚Â¢ÃƒÆ’Ã†â€™Ãƒâ€ Ã¢â‚¬â„¢ÃƒÆ’Ã¢â‚¬Å¡Ãƒâ€šÃ‚Â¢ÃƒÆ’Ã†â€™Ãƒâ€šÃ‚Â¢ÃƒÆ’Ã‚Â¢ÃƒÂ¢Ã¢â‚¬Å¡Ã‚Â¬Ãƒâ€¦Ã‚Â¡ÃƒÆ’Ã¢â‚¬Å¡Ãƒâ€šÃ‚Â¬ÃƒÆ’Ã†â€™ÃƒÂ¢Ã¢â€šÂ¬Ã…Â¡ÃƒÆ’Ã¢â‚¬Å¡Ãƒâ€šÃ‚Â¦ÃƒÆ’Ã†â€™Ãƒâ€ Ã¢â‚¬â„¢ÃƒÆ’Ã¢â‚¬Â ÃƒÂ¢Ã¢â€šÂ¬Ã¢â€žÂ¢ÃƒÆ’Ã†â€™Ãƒâ€šÃ‚Â¢ÃƒÆ’Ã‚Â¢ÃƒÂ¢Ã¢â€šÂ¬Ã…Â¡Ãƒâ€šÃ‚Â¬ÃƒÆ’Ã¢â‚¬Â¦Ãƒâ€šÃ‚Â¡ÃƒÆ’Ã†â€™Ãƒâ€ Ã¢â‚¬â„¢ÃƒÆ’Ã‚Â¢ÃƒÂ¢Ã¢â‚¬Å¡Ã‚Â¬Ãƒâ€¦Ã‚Â¡ÃƒÆ’Ã†â€™ÃƒÂ¢Ã¢â€šÂ¬Ã…Â¡ÃƒÆ’Ã¢â‚¬Å¡Ãƒâ€šÃ‚Â½ÃƒÆ’Ã†â€™Ãƒâ€ Ã¢â‚¬â„¢ÃƒÆ’Ã¢â‚¬Â ÃƒÂ¢Ã¢â€šÂ¬Ã¢â€žÂ¢ÃƒÆ’Ã†â€™ÃƒÂ¢Ã¢â€šÂ¬Ã‚Â ÃƒÆ’Ã‚Â¢ÃƒÂ¢Ã¢â‚¬Å¡Ã‚Â¬ÃƒÂ¢Ã¢â‚¬Å¾Ã‚Â¢ÃƒÆ’Ã†â€™Ãƒâ€ Ã¢â‚¬â„¢ÃƒÆ’Ã‚Â¢ÃƒÂ¢Ã¢â‚¬Å¡Ã‚Â¬Ãƒâ€šÃ‚Â ÃƒÆ’Ã†â€™Ãƒâ€šÃ‚Â¢ÃƒÆ’Ã‚Â¢ÃƒÂ¢Ã¢â€šÂ¬Ã…Â¡Ãƒâ€šÃ‚Â¬ÃƒÆ’Ã‚Â¢ÃƒÂ¢Ã¢â€šÂ¬Ã…Â¾Ãƒâ€šÃ‚Â¢ÃƒÆ’Ã†â€™Ãƒâ€ Ã¢â‚¬â„¢ÃƒÆ’Ã¢â‚¬Â ÃƒÂ¢Ã¢â€šÂ¬Ã¢â€žÂ¢ÃƒÆ’Ã†â€™ÃƒÂ¢Ã¢â€šÂ¬Ã…Â¡ÃƒÆ’Ã¢â‚¬Å¡Ãƒâ€šÃ‚Â¢ÃƒÆ’Ã†â€™Ãƒâ€ Ã¢â‚¬â„¢ÃƒÆ’Ã¢â‚¬Å¡Ãƒâ€šÃ‚Â¢ÃƒÆ’Ã†â€™Ãƒâ€šÃ‚Â¢ÃƒÆ’Ã‚Â¢ÃƒÂ¢Ã¢â€šÂ¬Ã…Â¡Ãƒâ€šÃ‚Â¬ÃƒÆ’Ã¢â‚¬Â¦Ãƒâ€šÃ‚Â¡ÃƒÆ’Ã†â€™ÃƒÂ¢Ã¢â€šÂ¬Ã…Â¡ÃƒÆ’Ã¢â‚¬Å¡Ãƒâ€šÃ‚Â¬ÃƒÆ’Ã†â€™Ãƒâ€ Ã¢â‚¬â„¢ÃƒÆ’Ã‚Â¢ÃƒÂ¢Ã¢â‚¬Å¡Ã‚Â¬Ãƒâ€šÃ‚Â¦ÃƒÆ’Ã†â€™ÃƒÂ¢Ã¢â€šÂ¬Ã…Â¡ÃƒÆ’Ã¢â‚¬Å¡Ãƒâ€šÃ‚Â¡ÃƒÆ’Ã†â€™Ãƒâ€ Ã¢â‚¬â„¢ÃƒÆ’Ã¢â‚¬Â ÃƒÂ¢Ã¢â€šÂ¬Ã¢â€žÂ¢ÃƒÆ’Ã†â€™ÃƒÂ¢Ã¢â€šÂ¬Ã‚Â ÃƒÆ’Ã‚Â¢ÃƒÂ¢Ã¢â‚¬Å¡Ã‚Â¬ÃƒÂ¢Ã¢â‚¬Å¾Ã‚Â¢ÃƒÆ’Ã†â€™Ãƒâ€ Ã¢â‚¬â„¢ÃƒÆ’Ã¢â‚¬Å¡Ãƒâ€šÃ‚Â¢ÃƒÆ’Ã†â€™Ãƒâ€šÃ‚Â¢ÃƒÆ’Ã‚Â¢ÃƒÂ¢Ã¢â‚¬Å¡Ã‚Â¬Ãƒâ€¦Ã‚Â¡ÃƒÆ’Ã¢â‚¬Å¡Ãƒâ€šÃ‚Â¬ÃƒÆ’Ã†â€™ÃƒÂ¢Ã¢â€šÂ¬Ã‚Â¦ÃƒÆ’Ã¢â‚¬Å¡Ãƒâ€šÃ‚Â¡ÃƒÆ’Ã†â€™Ãƒâ€ Ã¢â‚¬â„¢ÃƒÆ’Ã¢â‚¬Â ÃƒÂ¢Ã¢â€šÂ¬Ã¢â€žÂ¢ÃƒÆ’Ã†â€™Ãƒâ€šÃ‚Â¢ÃƒÆ’Ã‚Â¢ÃƒÂ¢Ã¢â€šÂ¬Ã…Â¡Ãƒâ€šÃ‚Â¬ÃƒÆ’Ã¢â‚¬Â¦Ãƒâ€šÃ‚Â¡ÃƒÆ’Ã†â€™Ãƒâ€ Ã¢â‚¬â„¢ÃƒÆ’Ã‚Â¢ÃƒÂ¢Ã¢â‚¬Å¡Ã‚Â¬Ãƒâ€¦Ã‚Â¡ÃƒÆ’Ã†â€™ÃƒÂ¢Ã¢â€šÂ¬Ã…Â¡ÃƒÆ’Ã¢â‚¬Å¡Ãƒâ€šÃ‚Â¼g</w:t>
+        <w:t>ÃƒÆ’Ã†â€™Ãƒâ€ Ã¢â‚¬â„¢ÃƒÆ’Ã¢â‚¬Â ÃƒÂ¢Ã¢â€šÂ¬Ã¢â€žÂ¢ÃƒÆ’Ã†â€™ÃƒÂ¢Ã¢â€šÂ¬Ã‚Â ÃƒÆ’Ã‚Â¢ÃƒÂ¢Ã¢â‚¬Å¡Ã‚Â¬ÃƒÂ¢Ã¢â‚¬Å¾Ã‚Â¢ÃƒÆ’Ã†â€™Ãƒâ€ Ã¢â‚¬â„¢ÃƒÆ’Ã‚Â¢ÃƒÂ¢Ã¢â‚¬Å¡Ã‚Â¬Ãƒâ€šÃ‚Â ÃƒÆ’Ã†â€™Ãƒâ€šÃ‚Â¢ÃƒÆ’Ã‚Â¢ÃƒÂ¢Ã¢â€šÂ¬Ã…Â¡Ãƒâ€šÃ‚Â¬ÃƒÆ’Ã‚Â¢ÃƒÂ¢Ã¢â€šÂ¬Ã…Â¾Ãƒâ€šÃ‚Â¢ÃƒÆ’Ã†â€™Ãƒâ€ Ã¢â‚¬â„¢ÃƒÆ’Ã¢â‚¬Â ÃƒÂ¢Ã¢â€šÂ¬Ã¢â€žÂ¢ÃƒÆ’Ã†â€™Ãƒâ€šÃ‚Â¢ÃƒÆ’Ã‚Â¢ÃƒÂ¢Ã¢â€šÂ¬Ã…Â¡Ãƒâ€šÃ‚Â¬ÃƒÆ’Ã¢â‚¬Å¡Ãƒâ€šÃ‚Â ÃƒÆ’Ã†â€™Ãƒâ€ Ã¢â‚¬â„¢ÃƒÆ’Ã¢â‚¬Å¡Ãƒâ€šÃ‚Â¢ÃƒÆ’Ã†â€™Ãƒâ€šÃ‚Â¢ÃƒÆ’Ã‚Â¢ÃƒÂ¢Ã¢â‚¬Å¡Ã‚Â¬Ãƒâ€¦Ã‚Â¡ÃƒÆ’Ã¢â‚¬Å¡Ãƒâ€šÃ‚Â¬ÃƒÆ’Ã†â€™Ãƒâ€šÃ‚Â¢ÃƒÆ’Ã‚Â¢ÃƒÂ¢Ã¢â‚¬Å¡Ã‚Â¬Ãƒâ€¦Ã‚Â¾ÃƒÆ’Ã¢â‚¬Å¡Ãƒâ€šÃ‚Â¢ÃƒÆ’Ã†â€™Ãƒâ€ Ã¢â‚¬â„¢ÃƒÆ’Ã¢â‚¬Â ÃƒÂ¢Ã¢â€šÂ¬Ã¢â€žÂ¢ÃƒÆ’Ã†â€™ÃƒÂ¢Ã¢â€šÂ¬Ã‚Â ÃƒÆ’Ã‚Â¢ÃƒÂ¢Ã¢â‚¬Å¡Ã‚Â¬ÃƒÂ¢Ã¢â‚¬Å¾Ã‚Â¢ÃƒÆ’Ã†â€™Ãƒâ€ Ã¢â‚¬â„¢ÃƒÆ’Ã¢â‚¬Å¡Ãƒâ€šÃ‚Â¢ÃƒÆ’Ã†â€™Ãƒâ€šÃ‚Â¢ÃƒÆ’Ã‚Â¢ÃƒÂ¢Ã¢â‚¬Å¡Ã‚Â¬Ãƒâ€¦Ã‚Â¡ÃƒÆ’Ã¢â‚¬Å¡Ãƒâ€šÃ‚Â¬ÃƒÆ’Ã†â€™ÃƒÂ¢Ã¢â€šÂ¬Ã…Â¡ÃƒÆ’Ã¢â‚¬Å¡Ãƒâ€šÃ‚Â ÃƒÆ’Ã†â€™Ãƒâ€ Ã¢â‚¬â„¢ÃƒÆ’Ã¢â‚¬Â ÃƒÂ¢Ã¢â€šÂ¬Ã¢â€žÂ¢ÃƒÆ’Ã†â€™ÃƒÂ¢Ã¢â€šÂ¬Ã…Â¡ÃƒÆ’Ã¢â‚¬Å¡Ãƒâ€šÃ‚Â¢ÃƒÆ’Ã†â€™Ãƒâ€ Ã¢â‚¬â„¢ÃƒÆ’Ã¢â‚¬Å¡Ãƒâ€šÃ‚Â¢ÃƒÆ’Ã†â€™Ãƒâ€šÃ‚Â¢ÃƒÆ’Ã‚Â¢ÃƒÂ¢Ã¢â€šÂ¬Ã…Â¡Ãƒâ€šÃ‚Â¬ÃƒÆ’Ã¢â‚¬Â¦Ãƒâ€šÃ‚Â¡ÃƒÆ’Ã†â€™ÃƒÂ¢Ã¢â€šÂ¬Ã…Â¡ÃƒÆ’Ã¢â‚¬Å¡Ãƒâ€šÃ‚Â¬ÃƒÆ’Ã†â€™Ãƒâ€ Ã¢â‚¬â„¢ÃƒÆ’Ã¢â‚¬Å¡Ãƒâ€šÃ‚Â¢ÃƒÆ’Ã†â€™Ãƒâ€šÃ‚Â¢ÃƒÆ’Ã‚Â¢ÃƒÂ¢Ã¢â€šÂ¬Ã…Â¡Ãƒâ€šÃ‚Â¬ÃƒÆ’Ã¢â‚¬Â¦Ãƒâ€šÃ‚Â¾ÃƒÆ’Ã†â€™ÃƒÂ¢Ã¢â€šÂ¬Ã…Â¡ÃƒÆ’Ã¢â‚¬Å¡Ãƒâ€šÃ‚Â¢ÃƒÆ’Ã†â€™Ãƒâ€ Ã¢â‚¬â„¢ÃƒÆ’Ã¢â‚¬Â ÃƒÂ¢Ã¢â€šÂ¬Ã¢â€žÂ¢ÃƒÆ’Ã†â€™ÃƒÂ¢Ã¢â€šÂ¬Ã‚Â ÃƒÆ’Ã‚Â¢ÃƒÂ¢Ã¢â‚¬Å¡Ã‚Â¬ÃƒÂ¢Ã¢â‚¬Å¾Ã‚Â¢ÃƒÆ’Ã†â€™Ãƒâ€ Ã¢â‚¬â„¢ÃƒÆ’Ã‚Â¢ÃƒÂ¢Ã¢â‚¬Å¡Ã‚Â¬Ãƒâ€šÃ‚Â ÃƒÆ’Ã†â€™Ãƒâ€šÃ‚Â¢ÃƒÆ’Ã‚Â¢ÃƒÂ¢Ã¢â€šÂ¬Ã…Â¡Ãƒâ€šÃ‚Â¬ÃƒÆ’Ã‚Â¢ÃƒÂ¢Ã¢â€šÂ¬Ã…Â¾Ãƒâ€šÃ‚Â¢ÃƒÆ’Ã†â€™Ãƒâ€ Ã¢â‚¬â„¢ÃƒÆ’Ã¢â‚¬Â ÃƒÂ¢Ã¢â€šÂ¬Ã¢â€žÂ¢ÃƒÆ’Ã†â€™ÃƒÂ¢Ã¢â€šÂ¬Ã…Â¡ÃƒÆ’Ã¢â‚¬Å¡Ãƒâ€šÃ‚Â¢ÃƒÆ’Ã†â€™Ãƒâ€ Ã¢â‚¬â„¢ÃƒÆ’Ã¢â‚¬Å¡Ãƒâ€šÃ‚Â¢ÃƒÆ’Ã†â€™Ãƒâ€šÃ‚Â¢ÃƒÆ’Ã‚Â¢ÃƒÂ¢Ã¢â€šÂ¬Ã…Â¡Ãƒâ€šÃ‚Â¬ÃƒÆ’Ã¢â‚¬Â¦Ãƒâ€šÃ‚Â¡ÃƒÆ’Ã†â€™ÃƒÂ¢Ã¢â€šÂ¬Ã…Â¡ÃƒÆ’Ã¢â‚¬Å¡Ãƒâ€šÃ‚Â¬ÃƒÆ’Ã†â€™Ãƒâ€ Ã¢â‚¬â„¢ÃƒÆ’Ã‚Â¢ÃƒÂ¢Ã¢â‚¬Å¡Ã‚Â¬Ãƒâ€¦Ã‚Â¡ÃƒÆ’Ã†â€™ÃƒÂ¢Ã¢â€šÂ¬Ã…Â¡ÃƒÆ’Ã¢â‚¬Å¡Ãƒâ€šÃ‚Â¦ÃƒÆ’Ã†â€™Ãƒâ€ Ã¢â‚¬â„¢ÃƒÆ’Ã¢â‚¬Â ÃƒÂ¢Ã¢â€šÂ¬Ã¢â€žÂ¢ÃƒÆ’Ã†â€™ÃƒÂ¢Ã¢â€šÂ¬Ã‚Â ÃƒÆ’Ã‚Â¢ÃƒÂ¢Ã¢â‚¬Å¡Ã‚Â¬ÃƒÂ¢Ã¢â‚¬Å¾Ã‚Â¢ÃƒÆ’Ã†â€™Ãƒâ€ Ã¢â‚¬â„¢ÃƒÆ’Ã¢â‚¬Å¡Ãƒâ€šÃ‚Â¢ÃƒÆ’Ã†â€™Ãƒâ€šÃ‚Â¢ÃƒÆ’Ã‚Â¢ÃƒÂ¢Ã¢â‚¬Å¡Ã‚Â¬Ãƒâ€¦Ã‚Â¡ÃƒÆ’Ã¢â‚¬Å¡Ãƒâ€šÃ‚Â¬ÃƒÆ’Ã†â€™ÃƒÂ¢Ã¢â€šÂ¬Ã‚Â¦ÃƒÆ’Ã¢â‚¬Å¡Ãƒâ€šÃ‚Â¡ÃƒÆ’Ã†â€™Ãƒâ€ Ã¢â‚¬â„¢ÃƒÆ’Ã¢â‚¬Â ÃƒÂ¢Ã¢â€šÂ¬Ã¢â€žÂ¢ÃƒÆ’Ã†â€™Ãƒâ€šÃ‚Â¢ÃƒÆ’Ã‚Â¢ÃƒÂ¢Ã¢â€šÂ¬Ã…Â¡Ãƒâ€šÃ‚Â¬ÃƒÆ’Ã¢â‚¬Â¦Ãƒâ€šÃ‚Â¡ÃƒÆ’Ã†â€™Ãƒâ€ Ã¢â‚¬â„¢ÃƒÆ’Ã‚Â¢ÃƒÂ¢Ã¢â‚¬Å¡Ã‚Â¬Ãƒâ€¦Ã‚Â¡ÃƒÆ’Ã†â€™ÃƒÂ¢Ã¢â€šÂ¬Ã…Â¡ÃƒÆ’Ã¢â‚¬Å¡Ãƒâ€šÃ‚Â½ÃƒÆ’Ã†â€™Ãƒâ€ Ã¢â‚¬â„¢ÃƒÆ’Ã¢â‚¬Â ÃƒÂ¢Ã¢â€šÂ¬Ã¢â€žÂ¢ÃƒÆ’Ã†â€™ÃƒÂ¢Ã¢â€šÂ¬Ã‚Â ÃƒÆ’Ã‚Â¢ÃƒÂ¢Ã¢â‚¬Å¡Ã‚Â¬ÃƒÂ¢Ã¢â‚¬Å¾Ã‚Â¢ÃƒÆ’Ã†â€™Ãƒâ€ Ã¢â‚¬â„¢ÃƒÆ’Ã‚Â¢ÃƒÂ¢Ã¢â‚¬Å¡Ã‚Â¬Ãƒâ€šÃ‚Â ÃƒÆ’Ã†â€™Ãƒâ€šÃ‚Â¢ÃƒÆ’Ã‚Â¢ÃƒÂ¢Ã¢â€šÂ¬Ã…Â¡Ãƒâ€šÃ‚Â¬ÃƒÆ’Ã‚Â¢ÃƒÂ¢Ã¢â€šÂ¬Ã…Â¾Ãƒâ€šÃ‚Â¢ÃƒÆ’Ã†â€™Ãƒâ€ Ã¢â‚¬â„¢ÃƒÆ’Ã¢â‚¬Â ÃƒÂ¢Ã¢â€šÂ¬Ã¢â€žÂ¢ÃƒÆ’Ã†â€™Ãƒâ€šÃ‚Â¢ÃƒÆ’Ã‚Â¢ÃƒÂ¢Ã¢â€šÂ¬Ã…Â¡Ãƒâ€šÃ‚Â¬ÃƒÆ’Ã¢â‚¬Å¡Ãƒâ€šÃ‚Â ÃƒÆ’Ã†â€™Ãƒâ€ Ã¢â‚¬â„¢ÃƒÆ’Ã¢â‚¬Å¡Ãƒâ€šÃ‚Â¢ÃƒÆ’Ã†â€™Ãƒâ€šÃ‚Â¢ÃƒÆ’Ã‚Â¢ÃƒÂ¢Ã¢â‚¬Å¡Ã‚Â¬Ãƒâ€¦Ã‚Â¡ÃƒÆ’Ã¢â‚¬Å¡Ãƒâ€šÃ‚Â¬ÃƒÆ’Ã†â€™Ãƒâ€šÃ‚Â¢ÃƒÆ’Ã‚Â¢ÃƒÂ¢Ã¢â‚¬Å¡Ã‚Â¬Ãƒâ€¦Ã‚Â¾ÃƒÆ’Ã¢â‚¬Å¡Ãƒâ€šÃ‚Â¢ÃƒÆ’Ã†â€™Ãƒâ€ Ã¢â‚¬â„¢ÃƒÆ’Ã¢â‚¬Â ÃƒÂ¢Ã¢â€šÂ¬Ã¢â€žÂ¢ÃƒÆ’Ã†â€™ÃƒÂ¢Ã¢â€šÂ¬Ã‚Â ÃƒÆ’Ã‚Â¢ÃƒÂ¢Ã¢â‚¬Å¡Ã‚Â¬ÃƒÂ¢Ã¢â‚¬Å¾Ã‚Â¢ÃƒÆ’Ã†â€™Ãƒâ€ Ã¢â‚¬â„¢ÃƒÆ’Ã‚Â¢ÃƒÂ¢Ã¢â‚¬Å¡Ã‚Â¬Ãƒâ€¦Ã‚Â¡ÃƒÆ’Ã†â€™ÃƒÂ¢Ã¢â€šÂ¬Ã…Â¡ÃƒÆ’Ã¢â‚¬Å¡Ãƒâ€šÃ‚Â¢ÃƒÆ’Ã†â€™Ãƒâ€ Ã¢â‚¬â„¢ÃƒÆ’Ã¢â‚¬Â ÃƒÂ¢Ã¢â€šÂ¬Ã¢â€žÂ¢ÃƒÆ’Ã†â€™ÃƒÂ¢Ã¢â€šÂ¬Ã…Â¡ÃƒÆ’Ã¢â‚¬Å¡Ãƒâ€šÃ‚Â¢ÃƒÆ’Ã†â€™Ãƒâ€ Ã¢â‚¬â„¢ÃƒÆ’Ã¢â‚¬Å¡Ãƒâ€šÃ‚Â¢ÃƒÆ’Ã†â€™Ãƒâ€šÃ‚Â¢ÃƒÆ’Ã‚Â¢ÃƒÂ¢Ã¢â‚¬Å¡Ã‚Â¬Ãƒâ€¦Ã‚Â¡ÃƒÆ’Ã¢â‚¬Å¡Ãƒâ€šÃ‚Â¬ÃƒÆ’Ã†â€™ÃƒÂ¢Ã¢â€šÂ¬Ã‚Â¦ÃƒÆ’Ã¢â‚¬Å¡Ãƒâ€šÃ‚Â¡ÃƒÆ’Ã†â€™Ãƒâ€ Ã¢â‚¬â„¢ÃƒÆ’Ã‚Â¢ÃƒÂ¢Ã¢â‚¬Å¡Ã‚Â¬Ãƒâ€¦Ã‚Â¡ÃƒÆ’Ã†â€™ÃƒÂ¢Ã¢â€šÂ¬Ã…Â¡ÃƒÆ’Ã¢â‚¬Å¡Ãƒâ€šÃ‚Â¬ÃƒÆ’Ã†â€™Ãƒâ€ Ã¢â‚¬â„¢ÃƒÆ’Ã¢â‚¬Â ÃƒÂ¢Ã¢â€šÂ¬Ã¢â€žÂ¢ÃƒÆ’Ã†â€™Ãƒâ€šÃ‚Â¢ÃƒÆ’Ã‚Â¢ÃƒÂ¢Ã¢â€šÂ¬Ã…Â¡Ãƒâ€šÃ‚Â¬ÃƒÆ’Ã¢â‚¬Å¡Ãƒâ€šÃ‚Â¦ÃƒÆ’Ã†â€™Ãƒâ€ Ã¢â‚¬â„¢ÃƒÆ’Ã‚Â¢ÃƒÂ¢Ã¢â‚¬Å¡Ã‚Â¬Ãƒâ€¦Ã‚Â¡ÃƒÆ’Ã†â€™ÃƒÂ¢Ã¢â€šÂ¬Ã…Â¡ÃƒÆ’Ã¢â‚¬Å¡Ãƒâ€šÃ‚Â¡ÃƒÆ’Ã†â€™Ãƒâ€ Ã¢â‚¬â„¢ÃƒÆ’Ã¢â‚¬Â ÃƒÂ¢Ã¢â€šÂ¬Ã¢â€žÂ¢ÃƒÆ’Ã†â€™ÃƒÂ¢Ã¢â€šÂ¬Ã‚Â ÃƒÆ’Ã‚Â¢ÃƒÂ¢Ã¢â‚¬Å¡Ã‚Â¬ÃƒÂ¢Ã¢â‚¬Å¾Ã‚Â¢ÃƒÆ’Ã†â€™Ãƒâ€ Ã¢â‚¬â„¢ÃƒÆ’Ã‚Â¢ÃƒÂ¢Ã¢â‚¬Å¡Ã‚Â¬Ãƒâ€šÃ‚Â ÃƒÆ’Ã†â€™Ãƒâ€šÃ‚Â¢ÃƒÆ’Ã‚Â¢ÃƒÂ¢Ã¢â€šÂ¬Ã…Â¡Ãƒâ€šÃ‚Â¬ÃƒÆ’Ã‚Â¢ÃƒÂ¢Ã¢â€šÂ¬Ã…Â¾Ãƒâ€šÃ‚Â¢ÃƒÆ’Ã†â€™Ãƒâ€ Ã¢â‚¬â„¢ÃƒÆ’Ã¢â‚¬Â ÃƒÂ¢Ã¢â€šÂ¬Ã¢â€žÂ¢ÃƒÆ’Ã†â€™ÃƒÂ¢Ã¢â€šÂ¬Ã…Â¡ÃƒÆ’Ã¢â‚¬Å¡Ãƒâ€šÃ‚Â¢ÃƒÆ’Ã†â€™Ãƒâ€ Ã¢â‚¬â„¢ÃƒÆ’Ã¢â‚¬Å¡Ãƒâ€šÃ‚Â¢ÃƒÆ’Ã†â€™Ãƒâ€šÃ‚Â¢ÃƒÆ’Ã‚Â¢ÃƒÂ¢Ã¢â€šÂ¬Ã…Â¡Ãƒâ€šÃ‚Â¬ÃƒÆ’Ã¢â‚¬Â¦Ãƒâ€šÃ‚Â¡ÃƒÆ’Ã†â€™ÃƒÂ¢Ã¢â€šÂ¬Ã…Â¡ÃƒÆ’Ã¢â‚¬Å¡Ãƒâ€šÃ‚Â¬ÃƒÆ’Ã†â€™Ãƒâ€ Ã¢â‚¬â„¢ÃƒÆ’Ã‚Â¢ÃƒÂ¢Ã¢â‚¬Å¡Ã‚Â¬Ãƒâ€šÃ‚Â¦ÃƒÆ’Ã†â€™ÃƒÂ¢Ã¢â€šÂ¬Ã…Â¡ÃƒÆ’Ã¢â‚¬Å¡Ãƒâ€šÃ‚Â¡ÃƒÆ’Ã†â€™Ãƒâ€ Ã¢â‚¬â„¢ÃƒÆ’Ã¢â‚¬Â ÃƒÂ¢Ã¢â€šÂ¬Ã¢â€žÂ¢ÃƒÆ’Ã†â€™ÃƒÂ¢Ã¢â€šÂ¬Ã‚Â ÃƒÆ’Ã‚Â¢ÃƒÂ¢Ã¢â‚¬Å¡Ã‚Â¬ÃƒÂ¢Ã¢â‚¬Å¾Ã‚Â¢ÃƒÆ’Ã†â€™Ãƒâ€ Ã¢â‚¬â„¢ÃƒÆ’Ã¢â‚¬Å¡Ãƒâ€šÃ‚Â¢ÃƒÆ’Ã†â€™Ãƒâ€šÃ‚Â¢ÃƒÆ’Ã‚Â¢ÃƒÂ¢Ã¢â‚¬Å¡Ã‚Â¬Ãƒâ€¦Ã‚Â¡ÃƒÆ’Ã¢â‚¬Å¡Ãƒâ€šÃ‚Â¬ÃƒÆ’Ã†â€™ÃƒÂ¢Ã¢â€šÂ¬Ã‚Â¦ÃƒÆ’Ã¢â‚¬Å¡Ãƒâ€šÃ‚Â¡ÃƒÆ’Ã†â€™Ãƒâ€ Ã¢â‚¬â„¢ÃƒÆ’Ã¢â‚¬Â ÃƒÂ¢Ã¢â€šÂ¬Ã¢â€žÂ¢ÃƒÆ’Ã†â€™Ãƒâ€šÃ‚Â¢ÃƒÆ’Ã‚Â¢ÃƒÂ¢Ã¢â€šÂ¬Ã…Â¡Ãƒâ€šÃ‚Â¬ÃƒÆ’Ã¢â‚¬Â¦Ãƒâ€šÃ‚Â¡ÃƒÆ’Ã†â€™Ãƒâ€ Ã¢â‚¬â„¢ÃƒÆ’Ã‚Â¢ÃƒÂ¢Ã¢â‚¬Å¡Ã‚Â¬Ãƒâ€¦Ã‚Â¡ÃƒÆ’Ã†â€™ÃƒÂ¢Ã¢â€šÂ¬Ã…Â¡ÃƒÆ’Ã¢â‚¬Å¡Ãƒâ€šÃ‚Â¼g</w:t>
       </w:r>
       <w:proofErr w:type="spellEnd"/>
       <w:r>
@@ -8578,7 +8578,7 @@
           <w:sz w:val="28"/>
           <w:szCs w:val="28"/>
         </w:rPr>
-        <w:t>ÃƒÆ’Ã†â€™Ãƒâ€ Ã¢â‚¬â„¢ÃƒÆ’Ã¢â‚¬Â ÃƒÂ¢Ã¢â€šÂ¬Ã¢â€žÂ¢ÃƒÆ’Ã†â€™ÃƒÂ¢Ã¢â€šÂ¬Ã‚Â ÃƒÆ’Ã‚Â¢ÃƒÂ¢Ã¢â‚¬Å¡Ã‚Â¬ÃƒÂ¢Ã¢â‚¬Å¾Ã‚Â¢ÃƒÆ’Ã†â€™Ãƒâ€ Ã¢â‚¬â„¢ÃƒÆ’Ã‚Â¢ÃƒÂ¢Ã¢â‚¬Å¡Ã‚Â¬Ãƒâ€šÃ‚Â ÃƒÆ’Ã†â€™Ãƒâ€šÃ‚Â¢ÃƒÆ’Ã‚Â¢ÃƒÂ¢Ã¢â€šÂ¬Ã…Â¡Ãƒâ€šÃ‚Â¬ÃƒÆ’Ã‚Â¢ÃƒÂ¢Ã¢â€šÂ¬Ã…Â¾Ãƒâ€šÃ‚Â¢ÃƒÆ’Ã†â€™Ãƒâ€ Ã¢â‚¬â„¢ÃƒÆ’Ã¢â‚¬Â ÃƒÂ¢Ã¢â€šÂ¬Ã¢â€žÂ¢ÃƒÆ’Ã†â€™Ãƒâ€šÃ‚Â¢ÃƒÆ’Ã‚Â¢ÃƒÂ¢Ã¢â€šÂ¬Ã…Â¡Ãƒâ€šÃ‚Â¬ÃƒÆ’Ã¢â‚¬Å¡Ãƒâ€šÃ‚Â ÃƒÆ’Ã†â€™Ãƒâ€ Ã¢â‚¬â„¢ÃƒÆ’Ã¢â‚¬Å¡Ãƒâ€šÃ‚Â¢ÃƒÆ’Ã†â€™Ãƒâ€šÃ‚Â¢ÃƒÆ’Ã‚Â¢ÃƒÂ¢Ã¢â‚¬Å¡Ã‚Â¬Ãƒâ€¦Ã‚Â¡ÃƒÆ’Ã¢â‚¬Å¡Ãƒâ€šÃ‚Â¬ÃƒÆ’Ã†â€™Ãƒâ€šÃ‚Â¢ÃƒÆ’Ã‚Â¢ÃƒÂ¢Ã¢â‚¬Å¡Ã‚Â¬Ãƒâ€¦Ã‚Â¾ÃƒÆ’Ã¢â‚¬Å¡Ãƒâ€šÃ‚Â¢ÃƒÆ’Ã†â€™Ãƒâ€ Ã¢â‚¬â„¢ÃƒÆ’Ã¢â‚¬Â ÃƒÂ¢Ã¢â€šÂ¬Ã¢â€žÂ¢ÃƒÆ’Ã†â€™ÃƒÂ¢Ã¢â€šÂ¬Ã‚Â ÃƒÆ’Ã‚Â¢ÃƒÂ¢Ã¢â‚¬Å¡Ã‚Â¬ÃƒÂ¢Ã¢â‚¬Å¾Ã‚Â¢ÃƒÆ’Ã†â€™Ãƒâ€ Ã¢â‚¬â„¢ÃƒÆ’Ã¢â‚¬Å¡Ãƒâ€šÃ‚Â¢ÃƒÆ’Ã†â€™Ãƒâ€šÃ‚Â¢ÃƒÆ’Ã‚Â¢ÃƒÂ¢Ã¢â‚¬Å¡Ã‚Â¬Ãƒâ€¦Ã‚Â¡ÃƒÆ’Ã¢â‚¬Å¡Ãƒâ€šÃ‚Â¬ÃƒÆ’Ã†â€™ÃƒÂ¢Ã¢â€šÂ¬Ã…Â¡ÃƒÆ’Ã¢â‚¬Å¡Ãƒâ€šÃ‚Â¦ÃƒÆ’Ã†â€™Ãƒâ€ Ã¢â‚¬â„¢ÃƒÆ’Ã¢â‚¬Â ÃƒÂ¢Ã¢â€šÂ¬Ã¢â€žÂ¢ÃƒÆ’Ã†â€™Ãƒâ€šÃ‚Â¢ÃƒÆ’Ã‚Â¢ÃƒÂ¢Ã¢â€šÂ¬Ã…Â¡Ãƒâ€šÃ‚Â¬ÃƒÆ’Ã¢â‚¬Â¦Ãƒâ€šÃ‚Â¡ÃƒÆ’Ã†â€™Ãƒâ€ Ã¢â‚¬â„¢ÃƒÆ’Ã‚Â¢ÃƒÂ¢Ã¢â‚¬Å¡Ã‚Â¬Ãƒâ€¦Ã‚Â¡ÃƒÆ’Ã†â€™ÃƒÂ¢Ã¢â€šÂ¬Ã…Â¡ÃƒÆ’Ã¢â‚¬Å¡Ãƒâ€šÃ‚Â½ÃƒÆ’Ã†â€™Ãƒâ€ Ã¢â‚¬â„¢ÃƒÆ’Ã¢â‚¬Â ÃƒÂ¢Ã¢â€šÂ¬Ã¢â€žÂ¢ÃƒÆ’Ã†â€™ÃƒÂ¢Ã¢â€šÂ¬Ã‚Â ÃƒÆ’Ã‚Â¢ÃƒÂ¢Ã¢â‚¬Å¡Ã‚Â¬ÃƒÂ¢Ã¢â‚¬Å¾Ã‚Â¢ÃƒÆ’Ã†â€™Ãƒâ€ Ã¢â‚¬â„¢ÃƒÆ’Ã‚Â¢ÃƒÂ¢Ã¢â‚¬Å¡Ã‚Â¬Ãƒâ€šÃ‚Â ÃƒÆ’Ã†â€™Ãƒâ€šÃ‚Â¢ÃƒÆ’Ã‚Â¢ÃƒÂ¢Ã¢â€šÂ¬Ã…Â¡Ãƒâ€šÃ‚Â¬ÃƒÆ’Ã‚Â¢ÃƒÂ¢Ã¢â€šÂ¬Ã…Â¾Ãƒâ€šÃ‚Â¢ÃƒÆ’Ã†â€™Ãƒâ€ Ã¢â‚¬â„¢ÃƒÆ’Ã¢â‚¬Â ÃƒÂ¢Ã¢â€šÂ¬Ã¢â€žÂ¢ÃƒÆ’Ã†â€™ÃƒÂ¢Ã¢â€šÂ¬Ã…Â¡ÃƒÆ’Ã¢â‚¬Å¡Ãƒâ€šÃ‚Â¢ÃƒÆ’Ã†â€™Ãƒâ€ Ã¢â‚¬â„¢ÃƒÆ’Ã¢â‚¬Å¡Ãƒâ€šÃ‚Â¢ÃƒÆ’Ã†â€™Ãƒâ€šÃ‚Â¢ÃƒÆ’Ã‚Â¢ÃƒÂ¢Ã¢â€šÂ¬Ã…Â¡Ãƒâ€šÃ‚Â¬ÃƒÆ’Ã¢â‚¬Â¦Ãƒâ€šÃ‚Â¡ÃƒÆ’Ã†â€™ÃƒÂ¢Ã¢â€šÂ¬Ã…Â¡ÃƒÆ’Ã¢â‚¬Å¡Ãƒâ€šÃ‚Â¬ÃƒÆ’Ã†â€™Ãƒâ€ Ã¢â‚¬â„¢ÃƒÆ’Ã‚Â¢ÃƒÂ¢Ã¢â‚¬Å¡Ã‚Â¬Ãƒâ€šÃ‚Â¦ÃƒÆ’Ã†â€™ÃƒÂ¢Ã¢â€šÂ¬Ã…Â¡ÃƒÆ’Ã¢â‚¬Å¡Ãƒâ€šÃ‚Â¡ÃƒÆ’Ã†â€™Ãƒâ€ Ã¢â‚¬â„¢ÃƒÆ’Ã¢â‚¬Â ÃƒÂ¢Ã¢â€šÂ¬Ã¢â€žÂ¢ÃƒÆ’Ã†â€™ÃƒÂ¢Ã¢â€šÂ¬Ã‚Â ÃƒÆ’Ã‚Â¢ÃƒÂ¢Ã¢â‚¬Å¡Ã‚Â¬ÃƒÂ¢Ã¢â‚¬Å¾Ã‚Â¢ÃƒÆ’Ã†â€™Ãƒâ€ Ã¢â‚¬â„¢ÃƒÆ’Ã¢â‚¬Å¡Ãƒâ€šÃ‚Â¢ÃƒÆ’Ã†â€™Ãƒâ€šÃ‚Â¢ÃƒÆ’Ã‚Â¢ÃƒÂ¢Ã¢â‚¬Å¡Ã‚Â¬Ãƒâ€¦Ã‚Â¡ÃƒÆ’Ã¢â‚¬Å¡Ãƒâ€šÃ‚Â¬ÃƒÆ’Ã†â€™ÃƒÂ¢Ã¢â€šÂ¬Ã‚Â¦ÃƒÆ’Ã¢â‚¬Å¡Ãƒâ€šÃ‚Â¡ÃƒÆ’Ã†â€™Ãƒâ€ Ã¢â‚¬â„¢ÃƒÆ’Ã¢â‚¬Â ÃƒÂ¢Ã¢â€šÂ¬Ã¢â€žÂ¢ÃƒÆ’Ã†â€™Ãƒâ€šÃ‚Â¢ÃƒÆ’Ã‚Â¢ÃƒÂ¢Ã¢â€šÂ¬Ã…Â¡Ãƒâ€šÃ‚Â¬ÃƒÆ’Ã¢â‚¬Â¦Ãƒâ€šÃ‚Â¡ÃƒÆ’Ã†â€™Ãƒâ€ Ã¢â‚¬â„¢ÃƒÆ’Ã‚Â¢ÃƒÂ¢Ã¢â‚¬Å¡Ã‚Â¬Ãƒâ€¦Ã‚Â¡ÃƒÆ’Ã†â€™ÃƒÂ¢Ã¢â€šÂ¬Ã…Â¡ÃƒÆ’Ã¢â‚¬Å¡Ãƒâ€šÃ‚Â¼g</w:t>
+        <w:t>ÃƒÆ’Ã†â€™Ãƒâ€ Ã¢â‚¬â„¢ÃƒÆ’Ã¢â‚¬Â ÃƒÂ¢Ã¢â€šÂ¬Ã¢â€žÂ¢ÃƒÆ’Ã†â€™ÃƒÂ¢Ã¢â€šÂ¬Ã‚Â ÃƒÆ’Ã‚Â¢ÃƒÂ¢Ã¢â‚¬Å¡Ã‚Â¬ÃƒÂ¢Ã¢â‚¬Å¾Ã‚Â¢ÃƒÆ’Ã†â€™Ãƒâ€ Ã¢â‚¬â„¢ÃƒÆ’Ã‚Â¢ÃƒÂ¢Ã¢â‚¬Å¡Ã‚Â¬Ãƒâ€šÃ‚Â ÃƒÆ’Ã†â€™Ãƒâ€šÃ‚Â¢ÃƒÆ’Ã‚Â¢ÃƒÂ¢Ã¢â€šÂ¬Ã…Â¡Ãƒâ€šÃ‚Â¬ÃƒÆ’Ã‚Â¢ÃƒÂ¢Ã¢â€šÂ¬Ã…Â¾Ãƒâ€šÃ‚Â¢ÃƒÆ’Ã†â€™Ãƒâ€ Ã¢â‚¬â„¢ÃƒÆ’Ã¢â‚¬Â ÃƒÂ¢Ã¢â€šÂ¬Ã¢â€žÂ¢ÃƒÆ’Ã†â€™Ãƒâ€šÃ‚Â¢ÃƒÆ’Ã‚Â¢ÃƒÂ¢Ã¢â€šÂ¬Ã…Â¡Ãƒâ€šÃ‚Â¬ÃƒÆ’Ã¢â‚¬Å¡Ãƒâ€šÃ‚Â ÃƒÆ’Ã†â€™Ãƒâ€ Ã¢â‚¬â„¢ÃƒÆ’Ã¢â‚¬Å¡Ãƒâ€šÃ‚Â¢ÃƒÆ’Ã†â€™Ãƒâ€šÃ‚Â¢ÃƒÆ’Ã‚Â¢ÃƒÂ¢Ã¢â‚¬Å¡Ã‚Â¬Ãƒâ€¦Ã‚Â¡ÃƒÆ’Ã¢â‚¬Å¡Ãƒâ€šÃ‚Â¬ÃƒÆ’Ã†â€™Ãƒâ€šÃ‚Â¢ÃƒÆ’Ã‚Â¢ÃƒÂ¢Ã¢â‚¬Å¡Ã‚Â¬Ãƒâ€¦Ã‚Â¾ÃƒÆ’Ã¢â‚¬Å¡Ãƒâ€šÃ‚Â¢ÃƒÆ’Ã†â€™Ãƒâ€ Ã¢â‚¬â„¢ÃƒÆ’Ã¢â‚¬Â ÃƒÂ¢Ã¢â€šÂ¬Ã¢â€žÂ¢ÃƒÆ’Ã†â€™ÃƒÂ¢Ã¢â€šÂ¬Ã‚Â ÃƒÆ’Ã‚Â¢ÃƒÂ¢Ã¢â‚¬Å¡Ã‚Â¬ÃƒÂ¢Ã¢â‚¬Å¾Ã‚Â¢ÃƒÆ’Ã†â€™Ãƒâ€ Ã¢â‚¬â„¢ÃƒÆ’Ã¢â‚¬Å¡Ãƒâ€šÃ‚Â¢ÃƒÆ’Ã†â€™Ãƒâ€šÃ‚Â¢ÃƒÆ’Ã‚Â¢ÃƒÂ¢Ã¢â‚¬Å¡Ã‚Â¬Ãƒâ€¦Ã‚Â¡ÃƒÆ’Ã¢â‚¬Å¡Ãƒâ€šÃ‚Â¬ÃƒÆ’Ã†â€™ÃƒÂ¢Ã¢â€šÂ¬Ã…Â¡ÃƒÆ’Ã¢â‚¬Å¡Ãƒâ€šÃ‚Â ÃƒÆ’Ã†â€™Ãƒâ€ Ã¢â‚¬â„¢ÃƒÆ’Ã¢â‚¬Â ÃƒÂ¢Ã¢â€šÂ¬Ã¢â€žÂ¢ÃƒÆ’Ã†â€™ÃƒÂ¢Ã¢â€šÂ¬Ã…Â¡ÃƒÆ’Ã¢â‚¬Å¡Ãƒâ€šÃ‚Â¢ÃƒÆ’Ã†â€™Ãƒâ€ Ã¢â‚¬â„¢ÃƒÆ’Ã¢â‚¬Å¡Ãƒâ€šÃ‚Â¢ÃƒÆ’Ã†â€™Ãƒâ€šÃ‚Â¢ÃƒÆ’Ã‚Â¢ÃƒÂ¢Ã¢â€šÂ¬Ã…Â¡Ãƒâ€šÃ‚Â¬ÃƒÆ’Ã¢â‚¬Â¦Ãƒâ€šÃ‚Â¡ÃƒÆ’Ã†â€™ÃƒÂ¢Ã¢â€šÂ¬Ã…Â¡ÃƒÆ’Ã¢â‚¬Å¡Ãƒâ€šÃ‚Â¬ÃƒÆ’Ã†â€™Ãƒâ€ Ã¢â‚¬â„¢ÃƒÆ’Ã¢â‚¬Å¡Ãƒâ€šÃ‚Â¢ÃƒÆ’Ã†â€™Ãƒâ€šÃ‚Â¢ÃƒÆ’Ã‚Â¢ÃƒÂ¢Ã¢â€šÂ¬Ã…Â¡Ãƒâ€šÃ‚Â¬ÃƒÆ’Ã¢â‚¬Â¦Ãƒâ€šÃ‚Â¾ÃƒÆ’Ã†â€™ÃƒÂ¢Ã¢â€šÂ¬Ã…Â¡ÃƒÆ’Ã¢â‚¬Å¡Ãƒâ€šÃ‚Â¢ÃƒÆ’Ã†â€™Ãƒâ€ Ã¢â‚¬â„¢ÃƒÆ’Ã¢â‚¬Â ÃƒÂ¢Ã¢â€šÂ¬Ã¢â€žÂ¢ÃƒÆ’Ã†â€™ÃƒÂ¢Ã¢â€šÂ¬Ã‚Â ÃƒÆ’Ã‚Â¢ÃƒÂ¢Ã¢â‚¬Å¡Ã‚Â¬ÃƒÂ¢Ã¢â‚¬Å¾Ã‚Â¢ÃƒÆ’Ã†â€™Ãƒâ€ Ã¢â‚¬â„¢ÃƒÆ’Ã‚Â¢ÃƒÂ¢Ã¢â‚¬Å¡Ã‚Â¬Ãƒâ€šÃ‚Â ÃƒÆ’Ã†â€™Ãƒâ€šÃ‚Â¢ÃƒÆ’Ã‚Â¢ÃƒÂ¢Ã¢â€šÂ¬Ã…Â¡Ãƒâ€šÃ‚Â¬ÃƒÆ’Ã‚Â¢ÃƒÂ¢Ã¢â€šÂ¬Ã…Â¾Ãƒâ€šÃ‚Â¢ÃƒÆ’Ã†â€™Ãƒâ€ Ã¢â‚¬â„¢ÃƒÆ’Ã¢â‚¬Â ÃƒÂ¢Ã¢â€šÂ¬Ã¢â€žÂ¢ÃƒÆ’Ã†â€™ÃƒÂ¢Ã¢â€šÂ¬Ã…Â¡ÃƒÆ’Ã¢â‚¬Å¡Ãƒâ€šÃ‚Â¢ÃƒÆ’Ã†â€™Ãƒâ€ Ã¢â‚¬â„¢ÃƒÆ’Ã¢â‚¬Å¡Ãƒâ€šÃ‚Â¢ÃƒÆ’Ã†â€™Ãƒâ€šÃ‚Â¢ÃƒÆ’Ã‚Â¢ÃƒÂ¢Ã¢â€šÂ¬Ã…Â¡Ãƒâ€šÃ‚Â¬ÃƒÆ’Ã¢â‚¬Â¦Ãƒâ€šÃ‚Â¡ÃƒÆ’Ã†â€™ÃƒÂ¢Ã¢â€šÂ¬Ã…Â¡ÃƒÆ’Ã¢â‚¬Å¡Ãƒâ€šÃ‚Â¬ÃƒÆ’Ã†â€™Ãƒâ€ Ã¢â‚¬â„¢ÃƒÆ’Ã‚Â¢ÃƒÂ¢Ã¢â‚¬Å¡Ã‚Â¬Ãƒâ€¦Ã‚Â¡ÃƒÆ’Ã†â€™ÃƒÂ¢Ã¢â€šÂ¬Ã…Â¡ÃƒÆ’Ã¢â‚¬Å¡Ãƒâ€šÃ‚Â¦ÃƒÆ’Ã†â€™Ãƒâ€ Ã¢â‚¬â„¢ÃƒÆ’Ã¢â‚¬Â ÃƒÂ¢Ã¢â€šÂ¬Ã¢â€žÂ¢ÃƒÆ’Ã†â€™ÃƒÂ¢Ã¢â€šÂ¬Ã‚Â ÃƒÆ’Ã‚Â¢ÃƒÂ¢Ã¢â‚¬Å¡Ã‚Â¬ÃƒÂ¢Ã¢â‚¬Å¾Ã‚Â¢ÃƒÆ’Ã†â€™Ãƒâ€ Ã¢â‚¬â„¢ÃƒÆ’Ã¢â‚¬Å¡Ãƒâ€šÃ‚Â¢ÃƒÆ’Ã†â€™Ãƒâ€šÃ‚Â¢ÃƒÆ’Ã‚Â¢ÃƒÂ¢Ã¢â‚¬Å¡Ã‚Â¬Ãƒâ€¦Ã‚Â¡ÃƒÆ’Ã¢â‚¬Å¡Ãƒâ€šÃ‚Â¬ÃƒÆ’Ã†â€™ÃƒÂ¢Ã¢â€šÂ¬Ã‚Â¦ÃƒÆ’Ã¢â‚¬Å¡Ãƒâ€šÃ‚Â¡ÃƒÆ’Ã†â€™Ãƒâ€ Ã¢â‚¬â„¢ÃƒÆ’Ã¢â‚¬Â ÃƒÂ¢Ã¢â€šÂ¬Ã¢â€žÂ¢ÃƒÆ’Ã†â€™Ãƒâ€šÃ‚Â¢ÃƒÆ’Ã‚Â¢ÃƒÂ¢Ã¢â€šÂ¬Ã…Â¡Ãƒâ€šÃ‚Â¬ÃƒÆ’Ã¢â‚¬Â¦Ãƒâ€šÃ‚Â¡ÃƒÆ’Ã†â€™Ãƒâ€ Ã¢â‚¬â„¢ÃƒÆ’Ã‚Â¢ÃƒÂ¢Ã¢â‚¬Å¡Ã‚Â¬Ãƒâ€¦Ã‚Â¡ÃƒÆ’Ã†â€™ÃƒÂ¢Ã¢â€šÂ¬Ã…Â¡ÃƒÆ’Ã¢â‚¬Å¡Ãƒâ€šÃ‚Â½ÃƒÆ’Ã†â€™Ãƒâ€ Ã¢â‚¬â„¢ÃƒÆ’Ã¢â‚¬Â ÃƒÂ¢Ã¢â€šÂ¬Ã¢â€žÂ¢ÃƒÆ’Ã†â€™ÃƒÂ¢Ã¢â€šÂ¬Ã‚Â ÃƒÆ’Ã‚Â¢ÃƒÂ¢Ã¢â‚¬Å¡Ã‚Â¬ÃƒÂ¢Ã¢â‚¬Å¾Ã‚Â¢ÃƒÆ’Ã†â€™Ãƒâ€ Ã¢â‚¬â„¢ÃƒÆ’Ã‚Â¢ÃƒÂ¢Ã¢â‚¬Å¡Ã‚Â¬Ãƒâ€šÃ‚Â ÃƒÆ’Ã†â€™Ãƒâ€šÃ‚Â¢ÃƒÆ’Ã‚Â¢ÃƒÂ¢Ã¢â€šÂ¬Ã…Â¡Ãƒâ€šÃ‚Â¬ÃƒÆ’Ã‚Â¢ÃƒÂ¢Ã¢â€šÂ¬Ã…Â¾Ãƒâ€šÃ‚Â¢ÃƒÆ’Ã†â€™Ãƒâ€ Ã¢â‚¬â„¢ÃƒÆ’Ã¢â‚¬Â ÃƒÂ¢Ã¢â€šÂ¬Ã¢â€žÂ¢ÃƒÆ’Ã†â€™Ãƒâ€šÃ‚Â¢ÃƒÆ’Ã‚Â¢ÃƒÂ¢Ã¢â€šÂ¬Ã…Â¡Ãƒâ€šÃ‚Â¬ÃƒÆ’Ã¢â‚¬Å¡Ãƒâ€šÃ‚Â ÃƒÆ’Ã†â€™Ãƒâ€ Ã¢â‚¬â„¢ÃƒÆ’Ã¢â‚¬Å¡Ãƒâ€šÃ‚Â¢ÃƒÆ’Ã†â€™Ãƒâ€šÃ‚Â¢ÃƒÆ’Ã‚Â¢ÃƒÂ¢Ã¢â‚¬Å¡Ã‚Â¬Ãƒâ€¦Ã‚Â¡ÃƒÆ’Ã¢â‚¬Å¡Ãƒâ€šÃ‚Â¬ÃƒÆ’Ã†â€™Ãƒâ€šÃ‚Â¢ÃƒÆ’Ã‚Â¢ÃƒÂ¢Ã¢â‚¬Å¡Ã‚Â¬Ãƒâ€¦Ã‚Â¾ÃƒÆ’Ã¢â‚¬Å¡Ãƒâ€šÃ‚Â¢ÃƒÆ’Ã†â€™Ãƒâ€ Ã¢â‚¬â„¢ÃƒÆ’Ã¢â‚¬Â ÃƒÂ¢Ã¢â€šÂ¬Ã¢â€žÂ¢ÃƒÆ’Ã†â€™ÃƒÂ¢Ã¢â€šÂ¬Ã‚Â ÃƒÆ’Ã‚Â¢ÃƒÂ¢Ã¢â‚¬Å¡Ã‚Â¬ÃƒÂ¢Ã¢â‚¬Å¾Ã‚Â¢ÃƒÆ’Ã†â€™Ãƒâ€ Ã¢â‚¬â„¢ÃƒÆ’Ã‚Â¢ÃƒÂ¢Ã¢â‚¬Å¡Ã‚Â¬Ãƒâ€¦Ã‚Â¡ÃƒÆ’Ã†â€™ÃƒÂ¢Ã¢â€šÂ¬Ã…Â¡ÃƒÆ’Ã¢â‚¬Å¡Ãƒâ€šÃ‚Â¢ÃƒÆ’Ã†â€™Ãƒâ€ Ã¢â‚¬â„¢ÃƒÆ’Ã¢â‚¬Â ÃƒÂ¢Ã¢â€šÂ¬Ã¢â€žÂ¢ÃƒÆ’Ã†â€™ÃƒÂ¢Ã¢â€šÂ¬Ã…Â¡ÃƒÆ’Ã¢â‚¬Å¡Ãƒâ€šÃ‚Â¢ÃƒÆ’Ã†â€™Ãƒâ€ Ã¢â‚¬â„¢ÃƒÆ’Ã¢â‚¬Å¡Ãƒâ€šÃ‚Â¢ÃƒÆ’Ã†â€™Ãƒâ€šÃ‚Â¢ÃƒÆ’Ã‚Â¢ÃƒÂ¢Ã¢â‚¬Å¡Ã‚Â¬Ãƒâ€¦Ã‚Â¡ÃƒÆ’Ã¢â‚¬Å¡Ãƒâ€šÃ‚Â¬ÃƒÆ’Ã†â€™ÃƒÂ¢Ã¢â€šÂ¬Ã‚Â¦ÃƒÆ’Ã¢â‚¬Å¡Ãƒâ€šÃ‚Â¡ÃƒÆ’Ã†â€™Ãƒâ€ Ã¢â‚¬â„¢ÃƒÆ’Ã‚Â¢ÃƒÂ¢Ã¢â‚¬Å¡Ã‚Â¬Ãƒâ€¦Ã‚Â¡ÃƒÆ’Ã†â€™ÃƒÂ¢Ã¢â€šÂ¬Ã…Â¡ÃƒÆ’Ã¢â‚¬Å¡Ãƒâ€šÃ‚Â¬ÃƒÆ’Ã†â€™Ãƒâ€ Ã¢â‚¬â„¢ÃƒÆ’Ã¢â‚¬Â ÃƒÂ¢Ã¢â€šÂ¬Ã¢â€žÂ¢ÃƒÆ’Ã†â€™Ãƒâ€šÃ‚Â¢ÃƒÆ’Ã‚Â¢ÃƒÂ¢Ã¢â€šÂ¬Ã…Â¡Ãƒâ€šÃ‚Â¬ÃƒÆ’Ã¢â‚¬Å¡Ãƒâ€šÃ‚Â¦ÃƒÆ’Ã†â€™Ãƒâ€ Ã¢â‚¬â„¢ÃƒÆ’Ã‚Â¢ÃƒÂ¢Ã¢â‚¬Å¡Ã‚Â¬Ãƒâ€¦Ã‚Â¡ÃƒÆ’Ã†â€™ÃƒÂ¢Ã¢â€šÂ¬Ã…Â¡ÃƒÆ’Ã¢â‚¬Å¡Ãƒâ€šÃ‚Â¡ÃƒÆ’Ã†â€™Ãƒâ€ Ã¢â‚¬â„¢ÃƒÆ’Ã¢â‚¬Â ÃƒÂ¢Ã¢â€šÂ¬Ã¢â€žÂ¢ÃƒÆ’Ã†â€™ÃƒÂ¢Ã¢â€šÂ¬Ã‚Â ÃƒÆ’Ã‚Â¢ÃƒÂ¢Ã¢â‚¬Å¡Ã‚Â¬ÃƒÂ¢Ã¢â‚¬Å¾Ã‚Â¢ÃƒÆ’Ã†â€™Ãƒâ€ Ã¢â‚¬â„¢ÃƒÆ’Ã‚Â¢ÃƒÂ¢Ã¢â‚¬Å¡Ã‚Â¬Ãƒâ€šÃ‚Â ÃƒÆ’Ã†â€™Ãƒâ€šÃ‚Â¢ÃƒÆ’Ã‚Â¢ÃƒÂ¢Ã¢â€šÂ¬Ã…Â¡Ãƒâ€šÃ‚Â¬ÃƒÆ’Ã‚Â¢ÃƒÂ¢Ã¢â€šÂ¬Ã…Â¾Ãƒâ€šÃ‚Â¢ÃƒÆ’Ã†â€™Ãƒâ€ Ã¢â‚¬â„¢ÃƒÆ’Ã¢â‚¬Â ÃƒÂ¢Ã¢â€šÂ¬Ã¢â€žÂ¢ÃƒÆ’Ã†â€™ÃƒÂ¢Ã¢â€šÂ¬Ã…Â¡ÃƒÆ’Ã¢â‚¬Å¡Ãƒâ€šÃ‚Â¢ÃƒÆ’Ã†â€™Ãƒâ€ Ã¢â‚¬â„¢ÃƒÆ’Ã¢â‚¬Å¡Ãƒâ€šÃ‚Â¢ÃƒÆ’Ã†â€™Ãƒâ€šÃ‚Â¢ÃƒÆ’Ã‚Â¢ÃƒÂ¢Ã¢â€šÂ¬Ã…Â¡Ãƒâ€šÃ‚Â¬ÃƒÆ’Ã¢â‚¬Â¦Ãƒâ€šÃ‚Â¡ÃƒÆ’Ã†â€™ÃƒÂ¢Ã¢â€šÂ¬Ã…Â¡ÃƒÆ’Ã¢â‚¬Å¡Ãƒâ€šÃ‚Â¬ÃƒÆ’Ã†â€™Ãƒâ€ Ã¢â‚¬â„¢ÃƒÆ’Ã‚Â¢ÃƒÂ¢Ã¢â‚¬Å¡Ã‚Â¬Ãƒâ€šÃ‚Â¦ÃƒÆ’Ã†â€™ÃƒÂ¢Ã¢â€šÂ¬Ã…Â¡ÃƒÆ’Ã¢â‚¬Å¡Ãƒâ€šÃ‚Â¡ÃƒÆ’Ã†â€™Ãƒâ€ Ã¢â‚¬â„¢ÃƒÆ’Ã¢â‚¬Â ÃƒÂ¢Ã¢â€šÂ¬Ã¢â€žÂ¢ÃƒÆ’Ã†â€™ÃƒÂ¢Ã¢â€šÂ¬Ã‚Â ÃƒÆ’Ã‚Â¢ÃƒÂ¢Ã¢â‚¬Å¡Ã‚Â¬ÃƒÂ¢Ã¢â‚¬Å¾Ã‚Â¢ÃƒÆ’Ã†â€™Ãƒâ€ Ã¢â‚¬â„¢ÃƒÆ’Ã¢â‚¬Å¡Ãƒâ€šÃ‚Â¢ÃƒÆ’Ã†â€™Ãƒâ€šÃ‚Â¢ÃƒÆ’Ã‚Â¢ÃƒÂ¢Ã¢â‚¬Å¡Ã‚Â¬Ãƒâ€¦Ã‚Â¡ÃƒÆ’Ã¢â‚¬Å¡Ãƒâ€šÃ‚Â¬ÃƒÆ’Ã†â€™ÃƒÂ¢Ã¢â€šÂ¬Ã‚Â¦ÃƒÆ’Ã¢â‚¬Å¡Ãƒâ€šÃ‚Â¡ÃƒÆ’Ã†â€™Ãƒâ€ Ã¢â‚¬â„¢ÃƒÆ’Ã¢â‚¬Â ÃƒÂ¢Ã¢â€šÂ¬Ã¢â€žÂ¢ÃƒÆ’Ã†â€™Ãƒâ€šÃ‚Â¢ÃƒÆ’Ã‚Â¢ÃƒÂ¢Ã¢â€šÂ¬Ã…Â¡Ãƒâ€šÃ‚Â¬ÃƒÆ’Ã¢â‚¬Â¦Ãƒâ€šÃ‚Â¡ÃƒÆ’Ã†â€™Ãƒâ€ Ã¢â‚¬â„¢ÃƒÆ’Ã‚Â¢ÃƒÂ¢Ã¢â‚¬Å¡Ã‚Â¬Ãƒâ€¦Ã‚Â¡ÃƒÆ’Ã†â€™ÃƒÂ¢Ã¢â€šÂ¬Ã…Â¡ÃƒÆ’Ã¢â‚¬Å¡Ãƒâ€šÃ‚Â¼g</w:t>
       </w:r>
       <w:proofErr w:type="spellEnd"/>
       <w:r>
@@ -8596,7 +8596,7 @@
           <w:sz w:val="28"/>
           <w:szCs w:val="28"/>
         </w:rPr>
-        <w:t>ÃƒÆ’Ã†â€™Ãƒâ€ Ã¢â‚¬â„¢ÃƒÆ’Ã¢â‚¬Â ÃƒÂ¢Ã¢â€šÂ¬Ã¢â€žÂ¢ÃƒÆ’Ã†â€™ÃƒÂ¢Ã¢â€šÂ¬Ã‚Â ÃƒÆ’Ã‚Â¢ÃƒÂ¢Ã¢â‚¬Å¡Ã‚Â¬ÃƒÂ¢Ã¢â‚¬Å¾Ã‚Â¢ÃƒÆ’Ã†â€™Ãƒâ€ Ã¢â‚¬â„¢ÃƒÆ’Ã‚Â¢ÃƒÂ¢Ã¢â‚¬Å¡Ã‚Â¬Ãƒâ€šÃ‚Â ÃƒÆ’Ã†â€™Ãƒâ€šÃ‚Â¢ÃƒÆ’Ã‚Â¢ÃƒÂ¢Ã¢â€šÂ¬Ã…Â¡Ãƒâ€šÃ‚Â¬ÃƒÆ’Ã‚Â¢ÃƒÂ¢Ã¢â€šÂ¬Ã…Â¾Ãƒâ€šÃ‚Â¢ÃƒÆ’Ã†â€™Ãƒâ€ Ã¢â‚¬â„¢ÃƒÆ’Ã¢â‚¬Â ÃƒÂ¢Ã¢â€šÂ¬Ã¢â€žÂ¢ÃƒÆ’Ã†â€™Ãƒâ€šÃ‚Â¢ÃƒÆ’Ã‚Â¢ÃƒÂ¢Ã¢â€šÂ¬Ã…Â¡Ãƒâ€šÃ‚Â¬ÃƒÆ’Ã¢â‚¬Å¡Ãƒâ€šÃ‚Â ÃƒÆ’Ã†â€™Ãƒâ€ Ã¢â‚¬â„¢ÃƒÆ’Ã¢â‚¬Å¡Ãƒâ€šÃ‚Â¢ÃƒÆ’Ã†â€™Ãƒâ€šÃ‚Â¢ÃƒÆ’Ã‚Â¢ÃƒÂ¢Ã¢â‚¬Å¡Ã‚Â¬Ãƒâ€¦Ã‚Â¡ÃƒÆ’Ã¢â‚¬Å¡Ãƒâ€šÃ‚Â¬ÃƒÆ’Ã†â€™Ãƒâ€šÃ‚Â¢ÃƒÆ’Ã‚Â¢ÃƒÂ¢Ã¢â‚¬Å¡Ã‚Â¬Ãƒâ€¦Ã‚Â¾ÃƒÆ’Ã¢â‚¬Å¡Ãƒâ€šÃ‚Â¢ÃƒÆ’Ã†â€™Ãƒâ€ Ã¢â‚¬â„¢ÃƒÆ’Ã¢â‚¬Â ÃƒÂ¢Ã¢â€šÂ¬Ã¢â€žÂ¢ÃƒÆ’Ã†â€™ÃƒÂ¢Ã¢â€šÂ¬Ã‚Â ÃƒÆ’Ã‚Â¢ÃƒÂ¢Ã¢â‚¬Å¡Ã‚Â¬ÃƒÂ¢Ã¢â‚¬Å¾Ã‚Â¢ÃƒÆ’Ã†â€™Ãƒâ€ Ã¢â‚¬â„¢ÃƒÆ’Ã¢â‚¬Å¡Ãƒâ€šÃ‚Â¢ÃƒÆ’Ã†â€™Ãƒâ€šÃ‚Â¢ÃƒÆ’Ã‚Â¢ÃƒÂ¢Ã¢â‚¬Å¡Ã‚Â¬Ãƒâ€¦Ã‚Â¡ÃƒÆ’Ã¢â‚¬Å¡Ãƒâ€šÃ‚Â¬ÃƒÆ’Ã†â€™ÃƒÂ¢Ã¢â€šÂ¬Ã…Â¡ÃƒÆ’Ã¢â‚¬Å¡Ãƒâ€šÃ‚Â¦ÃƒÆ’Ã†â€™Ãƒâ€ Ã¢â‚¬â„¢ÃƒÆ’Ã¢â‚¬Â ÃƒÂ¢Ã¢â€šÂ¬Ã¢â€žÂ¢ÃƒÆ’Ã†â€™Ãƒâ€šÃ‚Â¢ÃƒÆ’Ã‚Â¢ÃƒÂ¢Ã¢â€šÂ¬Ã…Â¡Ãƒâ€šÃ‚Â¬ÃƒÆ’Ã¢â‚¬Â¦Ãƒâ€šÃ‚Â¡ÃƒÆ’Ã†â€™Ãƒâ€ Ã¢â‚¬â„¢ÃƒÆ’Ã‚Â¢ÃƒÂ¢Ã¢â‚¬Å¡Ã‚Â¬Ãƒâ€¦Ã‚Â¡ÃƒÆ’Ã†â€™ÃƒÂ¢Ã¢â€šÂ¬Ã…Â¡ÃƒÆ’Ã¢â‚¬Å¡Ãƒâ€šÃ‚Â½ÃƒÆ’Ã†â€™Ãƒâ€ Ã¢â‚¬â„¢ÃƒÆ’Ã¢â‚¬Â ÃƒÂ¢Ã¢â€šÂ¬Ã¢â€žÂ¢ÃƒÆ’Ã†â€™ÃƒÂ¢Ã¢â€šÂ¬Ã‚Â ÃƒÆ’Ã‚Â¢ÃƒÂ¢Ã¢â‚¬Å¡Ã‚Â¬ÃƒÂ¢Ã¢â‚¬Å¾Ã‚Â¢ÃƒÆ’Ã†â€™Ãƒâ€ Ã¢â‚¬â„¢ÃƒÆ’Ã‚Â¢ÃƒÂ¢Ã¢â‚¬Å¡Ã‚Â¬Ãƒâ€šÃ‚Â ÃƒÆ’Ã†â€™Ãƒâ€šÃ‚Â¢ÃƒÆ’Ã‚Â¢ÃƒÂ¢Ã¢â€šÂ¬Ã…Â¡Ãƒâ€šÃ‚Â¬ÃƒÆ’Ã‚Â¢ÃƒÂ¢Ã¢â€šÂ¬Ã…Â¾Ãƒâ€šÃ‚Â¢ÃƒÆ’Ã†â€™Ãƒâ€ Ã¢â‚¬â„¢ÃƒÆ’Ã¢â‚¬Â ÃƒÂ¢Ã¢â€šÂ¬Ã¢â€žÂ¢ÃƒÆ’Ã†â€™ÃƒÂ¢Ã¢â€šÂ¬Ã…Â¡ÃƒÆ’Ã¢â‚¬Å¡Ãƒâ€šÃ‚Â¢ÃƒÆ’Ã†â€™Ãƒâ€ Ã¢â‚¬â„¢ÃƒÆ’Ã¢â‚¬Å¡Ãƒâ€šÃ‚Â¢ÃƒÆ’Ã†â€™Ãƒâ€šÃ‚Â¢ÃƒÆ’Ã‚Â¢ÃƒÂ¢Ã¢â€šÂ¬Ã…Â¡Ãƒâ€šÃ‚Â¬ÃƒÆ’Ã¢â‚¬Â¦Ãƒâ€šÃ‚Â¡ÃƒÆ’Ã†â€™ÃƒÂ¢Ã¢â€šÂ¬Ã…Â¡ÃƒÆ’Ã¢â‚¬Å¡Ãƒâ€šÃ‚Â¬ÃƒÆ’Ã†â€™Ãƒâ€ Ã¢â‚¬â„¢ÃƒÆ’Ã‚Â¢ÃƒÂ¢Ã¢â‚¬Å¡Ã‚Â¬Ãƒâ€šÃ‚Â¦ÃƒÆ’Ã†â€™ÃƒÂ¢Ã¢â€šÂ¬Ã…Â¡ÃƒÆ’Ã¢â‚¬Å¡Ãƒâ€šÃ‚Â¡ÃƒÆ’Ã†â€™Ãƒâ€ Ã¢â‚¬â„¢ÃƒÆ’Ã¢â‚¬Â ÃƒÂ¢Ã¢â€šÂ¬Ã¢â€žÂ¢ÃƒÆ’Ã†â€™ÃƒÂ¢Ã¢â€šÂ¬Ã‚Â ÃƒÆ’Ã‚Â¢ÃƒÂ¢Ã¢â‚¬Å¡Ã‚Â¬ÃƒÂ¢Ã¢â‚¬Å¾Ã‚Â¢ÃƒÆ’Ã†â€™Ãƒâ€ Ã¢â‚¬â„¢ÃƒÆ’Ã¢â‚¬Å¡Ãƒâ€šÃ‚Â¢ÃƒÆ’Ã†â€™Ãƒâ€šÃ‚Â¢ÃƒÆ’Ã‚Â¢ÃƒÂ¢Ã¢â‚¬Å¡Ã‚Â¬Ãƒâ€¦Ã‚Â¡ÃƒÆ’Ã¢â‚¬Å¡Ãƒâ€šÃ‚Â¬ÃƒÆ’Ã†â€™ÃƒÂ¢Ã¢â€šÂ¬Ã‚Â¦ÃƒÆ’Ã¢â‚¬Å¡Ãƒâ€šÃ‚Â¡ÃƒÆ’Ã†â€™Ãƒâ€ Ã¢â‚¬â„¢ÃƒÆ’Ã¢â‚¬Â ÃƒÂ¢Ã¢â€šÂ¬Ã¢â€žÂ¢ÃƒÆ’Ã†â€™Ãƒâ€šÃ‚Â¢ÃƒÆ’Ã‚Â¢ÃƒÂ¢Ã¢â€šÂ¬Ã…Â¡Ãƒâ€šÃ‚Â¬ÃƒÆ’Ã¢â‚¬Â¦Ãƒâ€šÃ‚Â¡ÃƒÆ’Ã†â€™Ãƒâ€ Ã¢â‚¬â„¢ÃƒÆ’Ã‚Â¢ÃƒÂ¢Ã¢â‚¬Å¡Ã‚Â¬Ãƒâ€¦Ã‚Â¡ÃƒÆ’Ã†â€™ÃƒÂ¢Ã¢â€šÂ¬Ã…Â¡ÃƒÆ’Ã¢â‚¬Å¡Ãƒâ€šÃ‚Â¼g</w:t>
+        <w:t>ÃƒÆ’Ã†â€™Ãƒâ€ Ã¢â‚¬â„¢ÃƒÆ’Ã¢â‚¬Â ÃƒÂ¢Ã¢â€šÂ¬Ã¢â€žÂ¢ÃƒÆ’Ã†â€™ÃƒÂ¢Ã¢â€šÂ¬Ã‚Â ÃƒÆ’Ã‚Â¢ÃƒÂ¢Ã¢â‚¬Å¡Ã‚Â¬ÃƒÂ¢Ã¢â‚¬Å¾Ã‚Â¢ÃƒÆ’Ã†â€™Ãƒâ€ Ã¢â‚¬â„¢ÃƒÆ’Ã‚Â¢ÃƒÂ¢Ã¢â‚¬Å¡Ã‚Â¬Ãƒâ€šÃ‚Â ÃƒÆ’Ã†â€™Ãƒâ€šÃ‚Â¢ÃƒÆ’Ã‚Â¢ÃƒÂ¢Ã¢â€šÂ¬Ã…Â¡Ãƒâ€šÃ‚Â¬ÃƒÆ’Ã‚Â¢ÃƒÂ¢Ã¢â€šÂ¬Ã…Â¾Ãƒâ€šÃ‚Â¢ÃƒÆ’Ã†â€™Ãƒâ€ Ã¢â‚¬â„¢ÃƒÆ’Ã¢â‚¬Â ÃƒÂ¢Ã¢â€šÂ¬Ã¢â€žÂ¢ÃƒÆ’Ã†â€™Ãƒâ€šÃ‚Â¢ÃƒÆ’Ã‚Â¢ÃƒÂ¢Ã¢â€šÂ¬Ã…Â¡Ãƒâ€šÃ‚Â¬ÃƒÆ’Ã¢â‚¬Å¡Ãƒâ€šÃ‚Â ÃƒÆ’Ã†â€™Ãƒâ€ Ã¢â‚¬â„¢ÃƒÆ’Ã¢â‚¬Å¡Ãƒâ€šÃ‚Â¢ÃƒÆ’Ã†â€™Ãƒâ€šÃ‚Â¢ÃƒÆ’Ã‚Â¢ÃƒÂ¢Ã¢â‚¬Å¡Ã‚Â¬Ãƒâ€¦Ã‚Â¡ÃƒÆ’Ã¢â‚¬Å¡Ãƒâ€šÃ‚Â¬ÃƒÆ’Ã†â€™Ãƒâ€šÃ‚Â¢ÃƒÆ’Ã‚Â¢ÃƒÂ¢Ã¢â‚¬Å¡Ã‚Â¬Ãƒâ€¦Ã‚Â¾ÃƒÆ’Ã¢â‚¬Å¡Ãƒâ€šÃ‚Â¢ÃƒÆ’Ã†â€™Ãƒâ€ Ã¢â‚¬â„¢ÃƒÆ’Ã¢â‚¬Â ÃƒÂ¢Ã¢â€šÂ¬Ã¢â€žÂ¢ÃƒÆ’Ã†â€™ÃƒÂ¢Ã¢â€šÂ¬Ã‚Â ÃƒÆ’Ã‚Â¢ÃƒÂ¢Ã¢â‚¬Å¡Ã‚Â¬ÃƒÂ¢Ã¢â‚¬Å¾Ã‚Â¢ÃƒÆ’Ã†â€™Ãƒâ€ Ã¢â‚¬â„¢ÃƒÆ’Ã¢â‚¬Å¡Ãƒâ€šÃ‚Â¢ÃƒÆ’Ã†â€™Ãƒâ€šÃ‚Â¢ÃƒÆ’Ã‚Â¢ÃƒÂ¢Ã¢â‚¬Å¡Ã‚Â¬Ãƒâ€¦Ã‚Â¡ÃƒÆ’Ã¢â‚¬Å¡Ãƒâ€šÃ‚Â¬ÃƒÆ’Ã†â€™ÃƒÂ¢Ã¢â€šÂ¬Ã…Â¡ÃƒÆ’Ã¢â‚¬Å¡Ãƒâ€šÃ‚Â ÃƒÆ’Ã†â€™Ãƒâ€ Ã¢â‚¬â„¢ÃƒÆ’Ã¢â‚¬Â ÃƒÂ¢Ã¢â€šÂ¬Ã¢â€žÂ¢ÃƒÆ’Ã†â€™ÃƒÂ¢Ã¢â€šÂ¬Ã…Â¡ÃƒÆ’Ã¢â‚¬Å¡Ãƒâ€šÃ‚Â¢ÃƒÆ’Ã†â€™Ãƒâ€ Ã¢â‚¬â„¢ÃƒÆ’Ã¢â‚¬Å¡Ãƒâ€šÃ‚Â¢ÃƒÆ’Ã†â€™Ãƒâ€šÃ‚Â¢ÃƒÆ’Ã‚Â¢ÃƒÂ¢Ã¢â€šÂ¬Ã…Â¡Ãƒâ€šÃ‚Â¬ÃƒÆ’Ã¢â‚¬Â¦Ãƒâ€šÃ‚Â¡ÃƒÆ’Ã†â€™ÃƒÂ¢Ã¢â€šÂ¬Ã…Â¡ÃƒÆ’Ã¢â‚¬Å¡Ãƒâ€šÃ‚Â¬ÃƒÆ’Ã†â€™Ãƒâ€ Ã¢â‚¬â„¢ÃƒÆ’Ã¢â‚¬Å¡Ãƒâ€šÃ‚Â¢ÃƒÆ’Ã†â€™Ãƒâ€šÃ‚Â¢ÃƒÆ’Ã‚Â¢ÃƒÂ¢Ã¢â€šÂ¬Ã…Â¡Ãƒâ€šÃ‚Â¬ÃƒÆ’Ã¢â‚¬Â¦Ãƒâ€šÃ‚Â¾ÃƒÆ’Ã†â€™ÃƒÂ¢Ã¢â€šÂ¬Ã…Â¡ÃƒÆ’Ã¢â‚¬Å¡Ãƒâ€šÃ‚Â¢ÃƒÆ’Ã†â€™Ãƒâ€ Ã¢â‚¬â„¢ÃƒÆ’Ã¢â‚¬Â ÃƒÂ¢Ã¢â€šÂ¬Ã¢â€žÂ¢ÃƒÆ’Ã†â€™ÃƒÂ¢Ã¢â€šÂ¬Ã‚Â ÃƒÆ’Ã‚Â¢ÃƒÂ¢Ã¢â‚¬Å¡Ã‚Â¬ÃƒÂ¢Ã¢â‚¬Å¾Ã‚Â¢ÃƒÆ’Ã†â€™Ãƒâ€ Ã¢â‚¬â„¢ÃƒÆ’Ã‚Â¢ÃƒÂ¢Ã¢â‚¬Å¡Ã‚Â¬Ãƒâ€šÃ‚Â ÃƒÆ’Ã†â€™Ãƒâ€šÃ‚Â¢ÃƒÆ’Ã‚Â¢ÃƒÂ¢Ã¢â€šÂ¬Ã…Â¡Ãƒâ€šÃ‚Â¬ÃƒÆ’Ã‚Â¢ÃƒÂ¢Ã¢â€šÂ¬Ã…Â¾Ãƒâ€šÃ‚Â¢ÃƒÆ’Ã†â€™Ãƒâ€ Ã¢â‚¬â„¢ÃƒÆ’Ã¢â‚¬Â ÃƒÂ¢Ã¢â€šÂ¬Ã¢â€žÂ¢ÃƒÆ’Ã†â€™ÃƒÂ¢Ã¢â€šÂ¬Ã…Â¡ÃƒÆ’Ã¢â‚¬Å¡Ãƒâ€šÃ‚Â¢ÃƒÆ’Ã†â€™Ãƒâ€ Ã¢â‚¬â„¢ÃƒÆ’Ã¢â‚¬Å¡Ãƒâ€šÃ‚Â¢ÃƒÆ’Ã†â€™Ãƒâ€šÃ‚Â¢ÃƒÆ’Ã‚Â¢ÃƒÂ¢Ã¢â€šÂ¬Ã…Â¡Ãƒâ€šÃ‚Â¬ÃƒÆ’Ã¢â‚¬Â¦Ãƒâ€šÃ‚Â¡ÃƒÆ’Ã†â€™ÃƒÂ¢Ã¢â€šÂ¬Ã…Â¡ÃƒÆ’Ã¢â‚¬Å¡Ãƒâ€šÃ‚Â¬ÃƒÆ’Ã†â€™Ãƒâ€ Ã¢â‚¬â„¢ÃƒÆ’Ã‚Â¢ÃƒÂ¢Ã¢â‚¬Å¡Ã‚Â¬Ãƒâ€¦Ã‚Â¡ÃƒÆ’Ã†â€™ÃƒÂ¢Ã¢â€šÂ¬Ã…Â¡ÃƒÆ’Ã¢â‚¬Å¡Ãƒâ€šÃ‚Â¦ÃƒÆ’Ã†â€™Ãƒâ€ Ã¢â‚¬â„¢ÃƒÆ’Ã¢â‚¬Â ÃƒÂ¢Ã¢â€šÂ¬Ã¢â€žÂ¢ÃƒÆ’Ã†â€™ÃƒÂ¢Ã¢â€šÂ¬Ã‚Â ÃƒÆ’Ã‚Â¢ÃƒÂ¢Ã¢â‚¬Å¡Ã‚Â¬ÃƒÂ¢Ã¢â‚¬Å¾Ã‚Â¢ÃƒÆ’Ã†â€™Ãƒâ€ Ã¢â‚¬â„¢ÃƒÆ’Ã¢â‚¬Å¡Ãƒâ€šÃ‚Â¢ÃƒÆ’Ã†â€™Ãƒâ€šÃ‚Â¢ÃƒÆ’Ã‚Â¢ÃƒÂ¢Ã¢â‚¬Å¡Ã‚Â¬Ãƒâ€¦Ã‚Â¡ÃƒÆ’Ã¢â‚¬Å¡Ãƒâ€šÃ‚Â¬ÃƒÆ’Ã†â€™ÃƒÂ¢Ã¢â€šÂ¬Ã‚Â¦ÃƒÆ’Ã¢â‚¬Å¡Ãƒâ€šÃ‚Â¡ÃƒÆ’Ã†â€™Ãƒâ€ Ã¢â‚¬â„¢ÃƒÆ’Ã¢â‚¬Â ÃƒÂ¢Ã¢â€šÂ¬Ã¢â€žÂ¢ÃƒÆ’Ã†â€™Ãƒâ€šÃ‚Â¢ÃƒÆ’Ã‚Â¢ÃƒÂ¢Ã¢â€šÂ¬Ã…Â¡Ãƒâ€šÃ‚Â¬ÃƒÆ’Ã¢â‚¬Â¦Ãƒâ€šÃ‚Â¡ÃƒÆ’Ã†â€™Ãƒâ€ Ã¢â‚¬â„¢ÃƒÆ’Ã‚Â¢ÃƒÂ¢Ã¢â‚¬Å¡Ã‚Â¬Ãƒâ€¦Ã‚Â¡ÃƒÆ’Ã†â€™ÃƒÂ¢Ã¢â€šÂ¬Ã…Â¡ÃƒÆ’Ã¢â‚¬Å¡Ãƒâ€šÃ‚Â½ÃƒÆ’Ã†â€™Ãƒâ€ Ã¢â‚¬â„¢ÃƒÆ’Ã¢â‚¬Â ÃƒÂ¢Ã¢â€šÂ¬Ã¢â€žÂ¢ÃƒÆ’Ã†â€™ÃƒÂ¢Ã¢â€šÂ¬Ã‚Â ÃƒÆ’Ã‚Â¢ÃƒÂ¢Ã¢â‚¬Å¡Ã‚Â¬ÃƒÂ¢Ã¢â‚¬Å¾Ã‚Â¢ÃƒÆ’Ã†â€™Ãƒâ€ Ã¢â‚¬â„¢ÃƒÆ’Ã‚Â¢ÃƒÂ¢Ã¢â‚¬Å¡Ã‚Â¬Ãƒâ€šÃ‚Â ÃƒÆ’Ã†â€™Ãƒâ€šÃ‚Â¢ÃƒÆ’Ã‚Â¢ÃƒÂ¢Ã¢â€šÂ¬Ã…Â¡Ãƒâ€šÃ‚Â¬ÃƒÆ’Ã‚Â¢ÃƒÂ¢Ã¢â€šÂ¬Ã…Â¾Ãƒâ€šÃ‚Â¢ÃƒÆ’Ã†â€™Ãƒâ€ Ã¢â‚¬â„¢ÃƒÆ’Ã¢â‚¬Â ÃƒÂ¢Ã¢â€šÂ¬Ã¢â€žÂ¢ÃƒÆ’Ã†â€™Ãƒâ€šÃ‚Â¢ÃƒÆ’Ã‚Â¢ÃƒÂ¢Ã¢â€šÂ¬Ã…Â¡Ãƒâ€šÃ‚Â¬ÃƒÆ’Ã¢â‚¬Å¡Ãƒâ€šÃ‚Â ÃƒÆ’Ã†â€™Ãƒâ€ Ã¢â‚¬â„¢ÃƒÆ’Ã¢â‚¬Å¡Ãƒâ€šÃ‚Â¢ÃƒÆ’Ã†â€™Ãƒâ€šÃ‚Â¢ÃƒÆ’Ã‚Â¢ÃƒÂ¢Ã¢â‚¬Å¡Ã‚Â¬Ãƒâ€¦Ã‚Â¡ÃƒÆ’Ã¢â‚¬Å¡Ãƒâ€šÃ‚Â¬ÃƒÆ’Ã†â€™Ãƒâ€šÃ‚Â¢ÃƒÆ’Ã‚Â¢ÃƒÂ¢Ã¢â‚¬Å¡Ã‚Â¬Ãƒâ€¦Ã‚Â¾ÃƒÆ’Ã¢â‚¬Å¡Ãƒâ€šÃ‚Â¢ÃƒÆ’Ã†â€™Ãƒâ€ Ã¢â‚¬â„¢ÃƒÆ’Ã¢â‚¬Â ÃƒÂ¢Ã¢â€šÂ¬Ã¢â€žÂ¢ÃƒÆ’Ã†â€™ÃƒÂ¢Ã¢â€šÂ¬Ã‚Â ÃƒÆ’Ã‚Â¢ÃƒÂ¢Ã¢â‚¬Å¡Ã‚Â¬ÃƒÂ¢Ã¢â‚¬Å¾Ã‚Â¢ÃƒÆ’Ã†â€™Ãƒâ€ Ã¢â‚¬â„¢ÃƒÆ’Ã‚Â¢ÃƒÂ¢Ã¢â‚¬Å¡Ã‚Â¬Ãƒâ€¦Ã‚Â¡ÃƒÆ’Ã†â€™ÃƒÂ¢Ã¢â€šÂ¬Ã…Â¡ÃƒÆ’Ã¢â‚¬Å¡Ãƒâ€šÃ‚Â¢ÃƒÆ’Ã†â€™Ãƒâ€ Ã¢â‚¬â„¢ÃƒÆ’Ã¢â‚¬Â ÃƒÂ¢Ã¢â€šÂ¬Ã¢â€žÂ¢ÃƒÆ’Ã†â€™ÃƒÂ¢Ã¢â€šÂ¬Ã…Â¡ÃƒÆ’Ã¢â‚¬Å¡Ãƒâ€šÃ‚Â¢ÃƒÆ’Ã†â€™Ãƒâ€ Ã¢â‚¬â„¢ÃƒÆ’Ã¢â‚¬Å¡Ãƒâ€šÃ‚Â¢ÃƒÆ’Ã†â€™Ãƒâ€šÃ‚Â¢ÃƒÆ’Ã‚Â¢ÃƒÂ¢Ã¢â‚¬Å¡Ã‚Â¬Ãƒâ€¦Ã‚Â¡ÃƒÆ’Ã¢â‚¬Å¡Ãƒâ€šÃ‚Â¬ÃƒÆ’Ã†â€™ÃƒÂ¢Ã¢â€šÂ¬Ã‚Â¦ÃƒÆ’Ã¢â‚¬Å¡Ãƒâ€šÃ‚Â¡ÃƒÆ’Ã†â€™Ãƒâ€ Ã¢â‚¬â„¢ÃƒÆ’Ã‚Â¢ÃƒÂ¢Ã¢â‚¬Å¡Ã‚Â¬Ãƒâ€¦Ã‚Â¡ÃƒÆ’Ã†â€™ÃƒÂ¢Ã¢â€šÂ¬Ã…Â¡ÃƒÆ’Ã¢â‚¬Å¡Ãƒâ€šÃ‚Â¬ÃƒÆ’Ã†â€™Ãƒâ€ Ã¢â‚¬â„¢ÃƒÆ’Ã¢â‚¬Â ÃƒÂ¢Ã¢â€šÂ¬Ã¢â€žÂ¢ÃƒÆ’Ã†â€™Ãƒâ€šÃ‚Â¢ÃƒÆ’Ã‚Â¢ÃƒÂ¢Ã¢â€šÂ¬Ã…Â¡Ãƒâ€šÃ‚Â¬ÃƒÆ’Ã¢â‚¬Å¡Ãƒâ€šÃ‚Â¦ÃƒÆ’Ã†â€™Ãƒâ€ Ã¢â‚¬â„¢ÃƒÆ’Ã‚Â¢ÃƒÂ¢Ã¢â‚¬Å¡Ã‚Â¬Ãƒâ€¦Ã‚Â¡ÃƒÆ’Ã†â€™ÃƒÂ¢Ã¢â€šÂ¬Ã…Â¡ÃƒÆ’Ã¢â‚¬Å¡Ãƒâ€šÃ‚Â¡ÃƒÆ’Ã†â€™Ãƒâ€ Ã¢â‚¬â„¢ÃƒÆ’Ã¢â‚¬Â ÃƒÂ¢Ã¢â€šÂ¬Ã¢â€žÂ¢ÃƒÆ’Ã†â€™ÃƒÂ¢Ã¢â€šÂ¬Ã‚Â ÃƒÆ’Ã‚Â¢ÃƒÂ¢Ã¢â‚¬Å¡Ã‚Â¬ÃƒÂ¢Ã¢â‚¬Å¾Ã‚Â¢ÃƒÆ’Ã†â€™Ãƒâ€ Ã¢â‚¬â„¢ÃƒÆ’Ã‚Â¢ÃƒÂ¢Ã¢â‚¬Å¡Ã‚Â¬Ãƒâ€šÃ‚Â ÃƒÆ’Ã†â€™Ãƒâ€šÃ‚Â¢ÃƒÆ’Ã‚Â¢ÃƒÂ¢Ã¢â€šÂ¬Ã…Â¡Ãƒâ€šÃ‚Â¬ÃƒÆ’Ã‚Â¢ÃƒÂ¢Ã¢â€šÂ¬Ã…Â¾Ãƒâ€šÃ‚Â¢ÃƒÆ’Ã†â€™Ãƒâ€ Ã¢â‚¬â„¢ÃƒÆ’Ã¢â‚¬Â ÃƒÂ¢Ã¢â€šÂ¬Ã¢â€žÂ¢ÃƒÆ’Ã†â€™ÃƒÂ¢Ã¢â€šÂ¬Ã…Â¡ÃƒÆ’Ã¢â‚¬Å¡Ãƒâ€šÃ‚Â¢ÃƒÆ’Ã†â€™Ãƒâ€ Ã¢â‚¬â„¢ÃƒÆ’Ã¢â‚¬Å¡Ãƒâ€šÃ‚Â¢ÃƒÆ’Ã†â€™Ãƒâ€šÃ‚Â¢ÃƒÆ’Ã‚Â¢ÃƒÂ¢Ã¢â€šÂ¬Ã…Â¡Ãƒâ€šÃ‚Â¬ÃƒÆ’Ã¢â‚¬Â¦Ãƒâ€šÃ‚Â¡ÃƒÆ’Ã†â€™ÃƒÂ¢Ã¢â€šÂ¬Ã…Â¡ÃƒÆ’Ã¢â‚¬Å¡Ãƒâ€šÃ‚Â¬ÃƒÆ’Ã†â€™Ãƒâ€ Ã¢â‚¬â„¢ÃƒÆ’Ã‚Â¢ÃƒÂ¢Ã¢â‚¬Å¡Ã‚Â¬Ãƒâ€šÃ‚Â¦ÃƒÆ’Ã†â€™ÃƒÂ¢Ã¢â€šÂ¬Ã…Â¡ÃƒÆ’Ã¢â‚¬Å¡Ãƒâ€šÃ‚Â¡ÃƒÆ’Ã†â€™Ãƒâ€ Ã¢â‚¬â„¢ÃƒÆ’Ã¢â‚¬Â ÃƒÂ¢Ã¢â€šÂ¬Ã¢â€žÂ¢ÃƒÆ’Ã†â€™ÃƒÂ¢Ã¢â€šÂ¬Ã‚Â ÃƒÆ’Ã‚Â¢ÃƒÂ¢Ã¢â‚¬Å¡Ã‚Â¬ÃƒÂ¢Ã¢â‚¬Å¾Ã‚Â¢ÃƒÆ’Ã†â€™Ãƒâ€ Ã¢â‚¬â„¢ÃƒÆ’Ã¢â‚¬Å¡Ãƒâ€šÃ‚Â¢ÃƒÆ’Ã†â€™Ãƒâ€šÃ‚Â¢ÃƒÆ’Ã‚Â¢ÃƒÂ¢Ã¢â‚¬Å¡Ã‚Â¬Ãƒâ€¦Ã‚Â¡ÃƒÆ’Ã¢â‚¬Å¡Ãƒâ€šÃ‚Â¬ÃƒÆ’Ã†â€™ÃƒÂ¢Ã¢â€šÂ¬Ã‚Â¦ÃƒÆ’Ã¢â‚¬Å¡Ãƒâ€šÃ‚Â¡ÃƒÆ’Ã†â€™Ãƒâ€ Ã¢â‚¬â„¢ÃƒÆ’Ã¢â‚¬Â ÃƒÂ¢Ã¢â€šÂ¬Ã¢â€žÂ¢ÃƒÆ’Ã†â€™Ãƒâ€šÃ‚Â¢ÃƒÆ’Ã‚Â¢ÃƒÂ¢Ã¢â€šÂ¬Ã…Â¡Ãƒâ€šÃ‚Â¬ÃƒÆ’Ã¢â‚¬Â¦Ãƒâ€šÃ‚Â¡ÃƒÆ’Ã†â€™Ãƒâ€ Ã¢â‚¬â„¢ÃƒÆ’Ã‚Â¢ÃƒÂ¢Ã¢â‚¬Å¡Ã‚Â¬Ãƒâ€¦Ã‚Â¡ÃƒÆ’Ã†â€™ÃƒÂ¢Ã¢â€šÂ¬Ã…Â¡ÃƒÆ’Ã¢â‚¬Å¡Ãƒâ€šÃ‚Â¼g</w:t>
       </w:r>
       <w:proofErr w:type="spellEnd"/>
       <w:r>
@@ -8632,7 +8632,7 @@
           <w:sz w:val="28"/>
           <w:szCs w:val="28"/>
         </w:rPr>
-        <w:t>ÃƒÆ’Ã†â€™Ãƒâ€ Ã¢â‚¬â„¢ÃƒÆ’Ã¢â‚¬Â ÃƒÂ¢Ã¢â€šÂ¬Ã¢â€žÂ¢ÃƒÆ’Ã†â€™ÃƒÂ¢Ã¢â€šÂ¬Ã‚Â ÃƒÆ’Ã‚Â¢ÃƒÂ¢Ã¢â‚¬Å¡Ã‚Â¬ÃƒÂ¢Ã¢â‚¬Å¾Ã‚Â¢ÃƒÆ’Ã†â€™Ãƒâ€ Ã¢â‚¬â„¢ÃƒÆ’Ã‚Â¢ÃƒÂ¢Ã¢â‚¬Å¡Ã‚Â¬Ãƒâ€šÃ‚Â ÃƒÆ’Ã†â€™Ãƒâ€šÃ‚Â¢ÃƒÆ’Ã‚Â¢ÃƒÂ¢Ã¢â€šÂ¬Ã…Â¡Ãƒâ€šÃ‚Â¬ÃƒÆ’Ã‚Â¢ÃƒÂ¢Ã¢â€šÂ¬Ã…Â¾Ãƒâ€šÃ‚Â¢ÃƒÆ’Ã†â€™Ãƒâ€ Ã¢â‚¬â„¢ÃƒÆ’Ã¢â‚¬Â ÃƒÂ¢Ã¢â€šÂ¬Ã¢â€žÂ¢ÃƒÆ’Ã†â€™Ãƒâ€šÃ‚Â¢ÃƒÆ’Ã‚Â¢ÃƒÂ¢Ã¢â€šÂ¬Ã…Â¡Ãƒâ€šÃ‚Â¬ÃƒÆ’Ã¢â‚¬Å¡Ãƒâ€šÃ‚Â ÃƒÆ’Ã†â€™Ãƒâ€ Ã¢â‚¬â„¢ÃƒÆ’Ã¢â‚¬Å¡Ãƒâ€šÃ‚Â¢ÃƒÆ’Ã†â€™Ãƒâ€šÃ‚Â¢ÃƒÆ’Ã‚Â¢ÃƒÂ¢Ã¢â‚¬Å¡Ã‚Â¬Ãƒâ€¦Ã‚Â¡ÃƒÆ’Ã¢â‚¬Å¡Ãƒâ€šÃ‚Â¬ÃƒÆ’Ã†â€™Ãƒâ€šÃ‚Â¢ÃƒÆ’Ã‚Â¢ÃƒÂ¢Ã¢â‚¬Å¡Ã‚Â¬Ãƒâ€¦Ã‚Â¾ÃƒÆ’Ã¢â‚¬Å¡Ãƒâ€šÃ‚Â¢ÃƒÆ’Ã†â€™Ãƒâ€ Ã¢â‚¬â„¢ÃƒÆ’Ã¢â‚¬Â ÃƒÂ¢Ã¢â€šÂ¬Ã¢â€žÂ¢ÃƒÆ’Ã†â€™ÃƒÂ¢Ã¢â€šÂ¬Ã‚Â ÃƒÆ’Ã‚Â¢ÃƒÂ¢Ã¢â‚¬Å¡Ã‚Â¬ÃƒÂ¢Ã¢â‚¬Å¾Ã‚Â¢ÃƒÆ’Ã†â€™Ãƒâ€ Ã¢â‚¬â„¢ÃƒÆ’Ã¢â‚¬Å¡Ãƒâ€šÃ‚Â¢ÃƒÆ’Ã†â€™Ãƒâ€šÃ‚Â¢ÃƒÆ’Ã‚Â¢ÃƒÂ¢Ã¢â‚¬Å¡Ã‚Â¬Ãƒâ€¦Ã‚Â¡ÃƒÆ’Ã¢â‚¬Å¡Ãƒâ€šÃ‚Â¬ÃƒÆ’Ã†â€™ÃƒÂ¢Ã¢â€šÂ¬Ã…Â¡ÃƒÆ’Ã¢â‚¬Å¡Ãƒâ€šÃ‚Â¦ÃƒÆ’Ã†â€™Ãƒâ€ Ã¢â‚¬â„¢ÃƒÆ’Ã¢â‚¬Â ÃƒÂ¢Ã¢â€šÂ¬Ã¢â€žÂ¢ÃƒÆ’Ã†â€™Ãƒâ€šÃ‚Â¢ÃƒÆ’Ã‚Â¢ÃƒÂ¢Ã¢â€šÂ¬Ã…Â¡Ãƒâ€šÃ‚Â¬ÃƒÆ’Ã¢â‚¬Â¦Ãƒâ€šÃ‚Â¡ÃƒÆ’Ã†â€™Ãƒâ€ Ã¢â‚¬â„¢ÃƒÆ’Ã‚Â¢ÃƒÂ¢Ã¢â‚¬Å¡Ã‚Â¬Ãƒâ€¦Ã‚Â¡ÃƒÆ’Ã†â€™ÃƒÂ¢Ã¢â€šÂ¬Ã…Â¡ÃƒÆ’Ã¢â‚¬Å¡Ãƒâ€šÃ‚Â½ÃƒÆ’Ã†â€™Ãƒâ€ Ã¢â‚¬â„¢ÃƒÆ’Ã¢â‚¬Â ÃƒÂ¢Ã¢â€šÂ¬Ã¢â€žÂ¢ÃƒÆ’Ã†â€™ÃƒÂ¢Ã¢â€šÂ¬Ã‚Â ÃƒÆ’Ã‚Â¢ÃƒÂ¢Ã¢â‚¬Å¡Ã‚Â¬ÃƒÂ¢Ã¢â‚¬Å¾Ã‚Â¢ÃƒÆ’Ã†â€™Ãƒâ€ Ã¢â‚¬â„¢ÃƒÆ’Ã‚Â¢ÃƒÂ¢Ã¢â‚¬Å¡Ã‚Â¬Ãƒâ€šÃ‚Â ÃƒÆ’Ã†â€™Ãƒâ€šÃ‚Â¢ÃƒÆ’Ã‚Â¢ÃƒÂ¢Ã¢â€šÂ¬Ã…Â¡Ãƒâ€šÃ‚Â¬ÃƒÆ’Ã‚Â¢ÃƒÂ¢Ã¢â€šÂ¬Ã…Â¾Ãƒâ€šÃ‚Â¢ÃƒÆ’Ã†â€™Ãƒâ€ Ã¢â‚¬â„¢ÃƒÆ’Ã¢â‚¬Â ÃƒÂ¢Ã¢â€šÂ¬Ã¢â€žÂ¢ÃƒÆ’Ã†â€™ÃƒÂ¢Ã¢â€šÂ¬Ã…Â¡ÃƒÆ’Ã¢â‚¬Å¡Ãƒâ€šÃ‚Â¢ÃƒÆ’Ã†â€™Ãƒâ€ Ã¢â‚¬â„¢ÃƒÆ’Ã¢â‚¬Å¡Ãƒâ€šÃ‚Â¢ÃƒÆ’Ã†â€™Ãƒâ€šÃ‚Â¢ÃƒÆ’Ã‚Â¢ÃƒÂ¢Ã¢â€šÂ¬Ã…Â¡Ãƒâ€šÃ‚Â¬ÃƒÆ’Ã¢â‚¬Â¦Ãƒâ€šÃ‚Â¡ÃƒÆ’Ã†â€™ÃƒÂ¢Ã¢â€šÂ¬Ã…Â¡ÃƒÆ’Ã¢â‚¬Å¡Ãƒâ€šÃ‚Â¬ÃƒÆ’Ã†â€™Ãƒâ€ Ã¢â‚¬â„¢ÃƒÆ’Ã‚Â¢ÃƒÂ¢Ã¢â‚¬Å¡Ã‚Â¬Ãƒâ€šÃ‚Â¦ÃƒÆ’Ã†â€™ÃƒÂ¢Ã¢â€šÂ¬Ã…Â¡ÃƒÆ’Ã¢â‚¬Å¡Ãƒâ€šÃ‚Â¡ÃƒÆ’Ã†â€™Ãƒâ€ Ã¢â‚¬â„¢ÃƒÆ’Ã¢â‚¬Â ÃƒÂ¢Ã¢â€šÂ¬Ã¢â€žÂ¢ÃƒÆ’Ã†â€™ÃƒÂ¢Ã¢â€šÂ¬Ã‚Â ÃƒÆ’Ã‚Â¢ÃƒÂ¢Ã¢â‚¬Å¡Ã‚Â¬ÃƒÂ¢Ã¢â‚¬Å¾Ã‚Â¢ÃƒÆ’Ã†â€™Ãƒâ€ Ã¢â‚¬â„¢ÃƒÆ’Ã¢â‚¬Å¡Ãƒâ€šÃ‚Â¢ÃƒÆ’Ã†â€™Ãƒâ€šÃ‚Â¢ÃƒÆ’Ã‚Â¢ÃƒÂ¢Ã¢â‚¬Å¡Ã‚Â¬Ãƒâ€¦Ã‚Â¡ÃƒÆ’Ã¢â‚¬Å¡Ãƒâ€šÃ‚Â¬ÃƒÆ’Ã†â€™ÃƒÂ¢Ã¢â€šÂ¬Ã‚Â¦ÃƒÆ’Ã¢â‚¬Å¡Ãƒâ€šÃ‚Â¡ÃƒÆ’Ã†â€™Ãƒâ€ Ã¢â‚¬â„¢ÃƒÆ’Ã¢â‚¬Â ÃƒÂ¢Ã¢â€šÂ¬Ã¢â€žÂ¢ÃƒÆ’Ã†â€™Ãƒâ€šÃ‚Â¢ÃƒÆ’Ã‚Â¢ÃƒÂ¢Ã¢â€šÂ¬Ã…Â¡Ãƒâ€šÃ‚Â¬ÃƒÆ’Ã¢â‚¬Â¦Ãƒâ€šÃ‚Â¡ÃƒÆ’Ã†â€™Ãƒâ€ Ã¢â‚¬â„¢ÃƒÆ’Ã‚Â¢ÃƒÂ¢Ã¢â‚¬Å¡Ã‚Â¬Ãƒâ€¦Ã‚Â¡ÃƒÆ’Ã†â€™ÃƒÂ¢Ã¢â€šÂ¬Ã…Â¡ÃƒÆ’Ã¢â‚¬Å¡Ãƒâ€šÃ‚Â¼g</w:t>
+        <w:t>ÃƒÆ’Ã†â€™Ãƒâ€ Ã¢â‚¬â„¢ÃƒÆ’Ã¢â‚¬Â ÃƒÂ¢Ã¢â€šÂ¬Ã¢â€žÂ¢ÃƒÆ’Ã†â€™ÃƒÂ¢Ã¢â€šÂ¬Ã‚Â ÃƒÆ’Ã‚Â¢ÃƒÂ¢Ã¢â‚¬Å¡Ã‚Â¬ÃƒÂ¢Ã¢â‚¬Å¾Ã‚Â¢ÃƒÆ’Ã†â€™Ãƒâ€ Ã¢â‚¬â„¢ÃƒÆ’Ã‚Â¢ÃƒÂ¢Ã¢â‚¬Å¡Ã‚Â¬Ãƒâ€šÃ‚Â ÃƒÆ’Ã†â€™Ãƒâ€šÃ‚Â¢ÃƒÆ’Ã‚Â¢ÃƒÂ¢Ã¢â€šÂ¬Ã…Â¡Ãƒâ€šÃ‚Â¬ÃƒÆ’Ã‚Â¢ÃƒÂ¢Ã¢â€šÂ¬Ã…Â¾Ãƒâ€šÃ‚Â¢ÃƒÆ’Ã†â€™Ãƒâ€ Ã¢â‚¬â„¢ÃƒÆ’Ã¢â‚¬Â ÃƒÂ¢Ã¢â€šÂ¬Ã¢â€žÂ¢ÃƒÆ’Ã†â€™Ãƒâ€šÃ‚Â¢ÃƒÆ’Ã‚Â¢ÃƒÂ¢Ã¢â€šÂ¬Ã…Â¡Ãƒâ€šÃ‚Â¬ÃƒÆ’Ã¢â‚¬Å¡Ãƒâ€šÃ‚Â ÃƒÆ’Ã†â€™Ãƒâ€ Ã¢â‚¬â„¢ÃƒÆ’Ã¢â‚¬Å¡Ãƒâ€šÃ‚Â¢ÃƒÆ’Ã†â€™Ãƒâ€šÃ‚Â¢ÃƒÆ’Ã‚Â¢ÃƒÂ¢Ã¢â‚¬Å¡Ã‚Â¬Ãƒâ€¦Ã‚Â¡ÃƒÆ’Ã¢â‚¬Å¡Ãƒâ€šÃ‚Â¬ÃƒÆ’Ã†â€™Ãƒâ€šÃ‚Â¢ÃƒÆ’Ã‚Â¢ÃƒÂ¢Ã¢â‚¬Å¡Ã‚Â¬Ãƒâ€¦Ã‚Â¾ÃƒÆ’Ã¢â‚¬Å¡Ãƒâ€šÃ‚Â¢ÃƒÆ’Ã†â€™Ãƒâ€ Ã¢â‚¬â„¢ÃƒÆ’Ã¢â‚¬Â ÃƒÂ¢Ã¢â€šÂ¬Ã¢â€žÂ¢ÃƒÆ’Ã†â€™ÃƒÂ¢Ã¢â€šÂ¬Ã‚Â ÃƒÆ’Ã‚Â¢ÃƒÂ¢Ã¢â‚¬Å¡Ã‚Â¬ÃƒÂ¢Ã¢â‚¬Å¾Ã‚Â¢ÃƒÆ’Ã†â€™Ãƒâ€ Ã¢â‚¬â„¢ÃƒÆ’Ã¢â‚¬Å¡Ãƒâ€šÃ‚Â¢ÃƒÆ’Ã†â€™Ãƒâ€šÃ‚Â¢ÃƒÆ’Ã‚Â¢ÃƒÂ¢Ã¢â‚¬Å¡Ã‚Â¬Ãƒâ€¦Ã‚Â¡ÃƒÆ’Ã¢â‚¬Å¡Ãƒâ€šÃ‚Â¬ÃƒÆ’Ã†â€™ÃƒÂ¢Ã¢â€šÂ¬Ã…Â¡ÃƒÆ’Ã¢â‚¬Å¡Ãƒâ€šÃ‚Â ÃƒÆ’Ã†â€™Ãƒâ€ Ã¢â‚¬â„¢ÃƒÆ’Ã¢â‚¬Â ÃƒÂ¢Ã¢â€šÂ¬Ã¢â€žÂ¢ÃƒÆ’Ã†â€™ÃƒÂ¢Ã¢â€šÂ¬Ã…Â¡ÃƒÆ’Ã¢â‚¬Å¡Ãƒâ€šÃ‚Â¢ÃƒÆ’Ã†â€™Ãƒâ€ Ã¢â‚¬â„¢ÃƒÆ’Ã¢â‚¬Å¡Ãƒâ€šÃ‚Â¢ÃƒÆ’Ã†â€™Ãƒâ€šÃ‚Â¢ÃƒÆ’Ã‚Â¢ÃƒÂ¢Ã¢â€šÂ¬Ã…Â¡Ãƒâ€šÃ‚Â¬ÃƒÆ’Ã¢â‚¬Â¦Ãƒâ€šÃ‚Â¡ÃƒÆ’Ã†â€™ÃƒÂ¢Ã¢â€šÂ¬Ã…Â¡ÃƒÆ’Ã¢â‚¬Å¡Ãƒâ€šÃ‚Â¬ÃƒÆ’Ã†â€™Ãƒâ€ Ã¢â‚¬â„¢ÃƒÆ’Ã¢â‚¬Å¡Ãƒâ€šÃ‚Â¢ÃƒÆ’Ã†â€™Ãƒâ€šÃ‚Â¢ÃƒÆ’Ã‚Â¢ÃƒÂ¢Ã¢â€šÂ¬Ã…Â¡Ãƒâ€šÃ‚Â¬ÃƒÆ’Ã¢â‚¬Â¦Ãƒâ€šÃ‚Â¾ÃƒÆ’Ã†â€™ÃƒÂ¢Ã¢â€šÂ¬Ã…Â¡ÃƒÆ’Ã¢â‚¬Å¡Ãƒâ€šÃ‚Â¢ÃƒÆ’Ã†â€™Ãƒâ€ Ã¢â‚¬â„¢ÃƒÆ’Ã¢â‚¬Â ÃƒÂ¢Ã¢â€šÂ¬Ã¢â€žÂ¢ÃƒÆ’Ã†â€™ÃƒÂ¢Ã¢â€šÂ¬Ã‚Â ÃƒÆ’Ã‚Â¢ÃƒÂ¢Ã¢â‚¬Å¡Ã‚Â¬ÃƒÂ¢Ã¢â‚¬Å¾Ã‚Â¢ÃƒÆ’Ã†â€™Ãƒâ€ Ã¢â‚¬â„¢ÃƒÆ’Ã‚Â¢ÃƒÂ¢Ã¢â‚¬Å¡Ã‚Â¬Ãƒâ€šÃ‚Â ÃƒÆ’Ã†â€™Ãƒâ€šÃ‚Â¢ÃƒÆ’Ã‚Â¢ÃƒÂ¢Ã¢â€šÂ¬Ã…Â¡Ãƒâ€šÃ‚Â¬ÃƒÆ’Ã‚Â¢ÃƒÂ¢Ã¢â€šÂ¬Ã…Â¾Ãƒâ€šÃ‚Â¢ÃƒÆ’Ã†â€™Ãƒâ€ Ã¢â‚¬â„¢ÃƒÆ’Ã¢â‚¬Â ÃƒÂ¢Ã¢â€šÂ¬Ã¢â€žÂ¢ÃƒÆ’Ã†â€™ÃƒÂ¢Ã¢â€šÂ¬Ã…Â¡ÃƒÆ’Ã¢â‚¬Å¡Ãƒâ€šÃ‚Â¢ÃƒÆ’Ã†â€™Ãƒâ€ Ã¢â‚¬â„¢ÃƒÆ’Ã¢â‚¬Å¡Ãƒâ€šÃ‚Â¢ÃƒÆ’Ã†â€™Ãƒâ€šÃ‚Â¢ÃƒÆ’Ã‚Â¢ÃƒÂ¢Ã¢â€šÂ¬Ã…Â¡Ãƒâ€šÃ‚Â¬ÃƒÆ’Ã¢â‚¬Â¦Ãƒâ€šÃ‚Â¡ÃƒÆ’Ã†â€™ÃƒÂ¢Ã¢â€šÂ¬Ã…Â¡ÃƒÆ’Ã¢â‚¬Å¡Ãƒâ€šÃ‚Â¬ÃƒÆ’Ã†â€™Ãƒâ€ Ã¢â‚¬â„¢ÃƒÆ’Ã‚Â¢ÃƒÂ¢Ã¢â‚¬Å¡Ã‚Â¬Ãƒâ€¦Ã‚Â¡ÃƒÆ’Ã†â€™ÃƒÂ¢Ã¢â€šÂ¬Ã…Â¡ÃƒÆ’Ã¢â‚¬Å¡Ãƒâ€šÃ‚Â¦ÃƒÆ’Ã†â€™Ãƒâ€ Ã¢â‚¬â„¢ÃƒÆ’Ã¢â‚¬Â ÃƒÂ¢Ã¢â€šÂ¬Ã¢â€žÂ¢ÃƒÆ’Ã†â€™ÃƒÂ¢Ã¢â€šÂ¬Ã‚Â ÃƒÆ’Ã‚Â¢ÃƒÂ¢Ã¢â‚¬Å¡Ã‚Â¬ÃƒÂ¢Ã¢â‚¬Å¾Ã‚Â¢ÃƒÆ’Ã†â€™Ãƒâ€ Ã¢â‚¬â„¢ÃƒÆ’Ã¢â‚¬Å¡Ãƒâ€šÃ‚Â¢ÃƒÆ’Ã†â€™Ãƒâ€šÃ‚Â¢ÃƒÆ’Ã‚Â¢ÃƒÂ¢Ã¢â‚¬Å¡Ã‚Â¬Ãƒâ€¦Ã‚Â¡ÃƒÆ’Ã¢â‚¬Å¡Ãƒâ€šÃ‚Â¬ÃƒÆ’Ã†â€™ÃƒÂ¢Ã¢â€šÂ¬Ã‚Â¦ÃƒÆ’Ã¢â‚¬Å¡Ãƒâ€šÃ‚Â¡ÃƒÆ’Ã†â€™Ãƒâ€ Ã¢â‚¬â„¢ÃƒÆ’Ã¢â‚¬Â ÃƒÂ¢Ã¢â€šÂ¬Ã¢â€žÂ¢ÃƒÆ’Ã†â€™Ãƒâ€šÃ‚Â¢ÃƒÆ’Ã‚Â¢ÃƒÂ¢Ã¢â€šÂ¬Ã…Â¡Ãƒâ€šÃ‚Â¬ÃƒÆ’Ã¢â‚¬Â¦Ãƒâ€šÃ‚Â¡ÃƒÆ’Ã†â€™Ãƒâ€ Ã¢â‚¬â„¢ÃƒÆ’Ã‚Â¢ÃƒÂ¢Ã¢â‚¬Å¡Ã‚Â¬Ãƒâ€¦Ã‚Â¡ÃƒÆ’Ã†â€™ÃƒÂ¢Ã¢â€šÂ¬Ã…Â¡ÃƒÆ’Ã¢â‚¬Å¡Ãƒâ€šÃ‚Â½ÃƒÆ’Ã†â€™Ãƒâ€ Ã¢â‚¬â„¢ÃƒÆ’Ã¢â‚¬Â ÃƒÂ¢Ã¢â€šÂ¬Ã¢â€žÂ¢ÃƒÆ’Ã†â€™ÃƒÂ¢Ã¢â€šÂ¬Ã‚Â ÃƒÆ’Ã‚Â¢ÃƒÂ¢Ã¢â‚¬Å¡Ã‚Â¬ÃƒÂ¢Ã¢â‚¬Å¾Ã‚Â¢ÃƒÆ’Ã†â€™Ãƒâ€ Ã¢â‚¬â„¢ÃƒÆ’Ã‚Â¢ÃƒÂ¢Ã¢â‚¬Å¡Ã‚Â¬Ãƒâ€šÃ‚Â ÃƒÆ’Ã†â€™Ãƒâ€šÃ‚Â¢ÃƒÆ’Ã‚Â¢ÃƒÂ¢Ã¢â€šÂ¬Ã…Â¡Ãƒâ€šÃ‚Â¬ÃƒÆ’Ã‚Â¢ÃƒÂ¢Ã¢â€šÂ¬Ã…Â¾Ãƒâ€šÃ‚Â¢ÃƒÆ’Ã†â€™Ãƒâ€ Ã¢â‚¬â„¢ÃƒÆ’Ã¢â‚¬Â ÃƒÂ¢Ã¢â€šÂ¬Ã¢â€žÂ¢ÃƒÆ’Ã†â€™Ãƒâ€šÃ‚Â¢ÃƒÆ’Ã‚Â¢ÃƒÂ¢Ã¢â€šÂ¬Ã…Â¡Ãƒâ€šÃ‚Â¬ÃƒÆ’Ã¢â‚¬Å¡Ãƒâ€šÃ‚Â ÃƒÆ’Ã†â€™Ãƒâ€ Ã¢â‚¬â„¢ÃƒÆ’Ã¢â‚¬Å¡Ãƒâ€šÃ‚Â¢ÃƒÆ’Ã†â€™Ãƒâ€šÃ‚Â¢ÃƒÆ’Ã‚Â¢ÃƒÂ¢Ã¢â‚¬Å¡Ã‚Â¬Ãƒâ€¦Ã‚Â¡ÃƒÆ’Ã¢â‚¬Å¡Ãƒâ€šÃ‚Â¬ÃƒÆ’Ã†â€™Ãƒâ€šÃ‚Â¢ÃƒÆ’Ã‚Â¢ÃƒÂ¢Ã¢â‚¬Å¡Ã‚Â¬Ãƒâ€¦Ã‚Â¾ÃƒÆ’Ã¢â‚¬Å¡Ãƒâ€šÃ‚Â¢ÃƒÆ’Ã†â€™Ãƒâ€ Ã¢â‚¬â„¢ÃƒÆ’Ã¢â‚¬Â ÃƒÂ¢Ã¢â€šÂ¬Ã¢â€žÂ¢ÃƒÆ’Ã†â€™ÃƒÂ¢Ã¢â€šÂ¬Ã‚Â ÃƒÆ’Ã‚Â¢ÃƒÂ¢Ã¢â‚¬Å¡Ã‚Â¬ÃƒÂ¢Ã¢â‚¬Å¾Ã‚Â¢ÃƒÆ’Ã†â€™Ãƒâ€ Ã¢â‚¬â„¢ÃƒÆ’Ã‚Â¢ÃƒÂ¢Ã¢â‚¬Å¡Ã‚Â¬Ãƒâ€¦Ã‚Â¡ÃƒÆ’Ã†â€™ÃƒÂ¢Ã¢â€šÂ¬Ã…Â¡ÃƒÆ’Ã¢â‚¬Å¡Ãƒâ€šÃ‚Â¢ÃƒÆ’Ã†â€™Ãƒâ€ Ã¢â‚¬â„¢ÃƒÆ’Ã¢â‚¬Â ÃƒÂ¢Ã¢â€šÂ¬Ã¢â€žÂ¢ÃƒÆ’Ã†â€™ÃƒÂ¢Ã¢â€šÂ¬Ã…Â¡ÃƒÆ’Ã¢â‚¬Å¡Ãƒâ€šÃ‚Â¢ÃƒÆ’Ã†â€™Ãƒâ€ Ã¢â‚¬â„¢ÃƒÆ’Ã¢â‚¬Å¡Ãƒâ€šÃ‚Â¢ÃƒÆ’Ã†â€™Ãƒâ€šÃ‚Â¢ÃƒÆ’Ã‚Â¢ÃƒÂ¢Ã¢â‚¬Å¡Ã‚Â¬Ãƒâ€¦Ã‚Â¡ÃƒÆ’Ã¢â‚¬Å¡Ãƒâ€šÃ‚Â¬ÃƒÆ’Ã†â€™ÃƒÂ¢Ã¢â€šÂ¬Ã‚Â¦ÃƒÆ’Ã¢â‚¬Å¡Ãƒâ€šÃ‚Â¡ÃƒÆ’Ã†â€™Ãƒâ€ Ã¢â‚¬â„¢ÃƒÆ’Ã‚Â¢ÃƒÂ¢Ã¢â‚¬Å¡Ã‚Â¬Ãƒâ€¦Ã‚Â¡ÃƒÆ’Ã†â€™ÃƒÂ¢Ã¢â€šÂ¬Ã…Â¡ÃƒÆ’Ã¢â‚¬Å¡Ãƒâ€šÃ‚Â¬ÃƒÆ’Ã†â€™Ãƒâ€ Ã¢â‚¬â„¢ÃƒÆ’Ã¢â‚¬Â ÃƒÂ¢Ã¢â€šÂ¬Ã¢â€žÂ¢ÃƒÆ’Ã†â€™Ãƒâ€šÃ‚Â¢ÃƒÆ’Ã‚Â¢ÃƒÂ¢Ã¢â€šÂ¬Ã…Â¡Ãƒâ€šÃ‚Â¬ÃƒÆ’Ã¢â‚¬Å¡Ãƒâ€šÃ‚Â¦ÃƒÆ’Ã†â€™Ãƒâ€ Ã¢â‚¬â„¢ÃƒÆ’Ã‚Â¢ÃƒÂ¢Ã¢â‚¬Å¡Ã‚Â¬Ãƒâ€¦Ã‚Â¡ÃƒÆ’Ã†â€™ÃƒÂ¢Ã¢â€šÂ¬Ã…Â¡ÃƒÆ’Ã¢â‚¬Å¡Ãƒâ€šÃ‚Â¡ÃƒÆ’Ã†â€™Ãƒâ€ Ã¢â‚¬â„¢ÃƒÆ’Ã¢â‚¬Â ÃƒÂ¢Ã¢â€šÂ¬Ã¢â€žÂ¢ÃƒÆ’Ã†â€™ÃƒÂ¢Ã¢â€šÂ¬Ã‚Â ÃƒÆ’Ã‚Â¢ÃƒÂ¢Ã¢â‚¬Å¡Ã‚Â¬ÃƒÂ¢Ã¢â‚¬Å¾Ã‚Â¢ÃƒÆ’Ã†â€™Ãƒâ€ Ã¢â‚¬â„¢ÃƒÆ’Ã‚Â¢ÃƒÂ¢Ã¢â‚¬Å¡Ã‚Â¬Ãƒâ€šÃ‚Â ÃƒÆ’Ã†â€™Ãƒâ€šÃ‚Â¢ÃƒÆ’Ã‚Â¢ÃƒÂ¢Ã¢â€šÂ¬Ã…Â¡Ãƒâ€šÃ‚Â¬ÃƒÆ’Ã‚Â¢ÃƒÂ¢Ã¢â€šÂ¬Ã…Â¾Ãƒâ€šÃ‚Â¢ÃƒÆ’Ã†â€™Ãƒâ€ Ã¢â‚¬â„¢ÃƒÆ’Ã¢â‚¬Â ÃƒÂ¢Ã¢â€šÂ¬Ã¢â€žÂ¢ÃƒÆ’Ã†â€™ÃƒÂ¢Ã¢â€šÂ¬Ã…Â¡ÃƒÆ’Ã¢â‚¬Å¡Ãƒâ€šÃ‚Â¢ÃƒÆ’Ã†â€™Ãƒâ€ Ã¢â‚¬â„¢ÃƒÆ’Ã¢â‚¬Å¡Ãƒâ€šÃ‚Â¢ÃƒÆ’Ã†â€™Ãƒâ€šÃ‚Â¢ÃƒÆ’Ã‚Â¢ÃƒÂ¢Ã¢â€šÂ¬Ã…Â¡Ãƒâ€šÃ‚Â¬ÃƒÆ’Ã¢â‚¬Â¦Ãƒâ€šÃ‚Â¡ÃƒÆ’Ã†â€™ÃƒÂ¢Ã¢â€šÂ¬Ã…Â¡ÃƒÆ’Ã¢â‚¬Å¡Ãƒâ€šÃ‚Â¬ÃƒÆ’Ã†â€™Ãƒâ€ Ã¢â‚¬â„¢ÃƒÆ’Ã‚Â¢ÃƒÂ¢Ã¢â‚¬Å¡Ã‚Â¬Ãƒâ€šÃ‚Â¦ÃƒÆ’Ã†â€™ÃƒÂ¢Ã¢â€šÂ¬Ã…Â¡ÃƒÆ’Ã¢â‚¬Å¡Ãƒâ€šÃ‚Â¡ÃƒÆ’Ã†â€™Ãƒâ€ Ã¢â‚¬â„¢ÃƒÆ’Ã¢â‚¬Â ÃƒÂ¢Ã¢â€šÂ¬Ã¢â€žÂ¢ÃƒÆ’Ã†â€™ÃƒÂ¢Ã¢â€šÂ¬Ã‚Â ÃƒÆ’Ã‚Â¢ÃƒÂ¢Ã¢â‚¬Å¡Ã‚Â¬ÃƒÂ¢Ã¢â‚¬Å¾Ã‚Â¢ÃƒÆ’Ã†â€™Ãƒâ€ Ã¢â‚¬â„¢ÃƒÆ’Ã¢â‚¬Å¡Ãƒâ€šÃ‚Â¢ÃƒÆ’Ã†â€™Ãƒâ€šÃ‚Â¢ÃƒÆ’Ã‚Â¢ÃƒÂ¢Ã¢â‚¬Å¡Ã‚Â¬Ãƒâ€¦Ã‚Â¡ÃƒÆ’Ã¢â‚¬Å¡Ãƒâ€šÃ‚Â¬ÃƒÆ’Ã†â€™ÃƒÂ¢Ã¢â€šÂ¬Ã‚Â¦ÃƒÆ’Ã¢â‚¬Å¡Ãƒâ€šÃ‚Â¡ÃƒÆ’Ã†â€™Ãƒâ€ Ã¢â‚¬â„¢ÃƒÆ’Ã¢â‚¬Â ÃƒÂ¢Ã¢â€šÂ¬Ã¢â€žÂ¢ÃƒÆ’Ã†â€™Ãƒâ€šÃ‚Â¢ÃƒÆ’Ã‚Â¢ÃƒÂ¢Ã¢â€šÂ¬Ã…Â¡Ãƒâ€šÃ‚Â¬ÃƒÆ’Ã¢â‚¬Â¦Ãƒâ€šÃ‚Â¡ÃƒÆ’Ã†â€™Ãƒâ€ Ã¢â‚¬â„¢ÃƒÆ’Ã‚Â¢ÃƒÂ¢Ã¢â‚¬Å¡Ã‚Â¬Ãƒâ€¦Ã‚Â¡ÃƒÆ’Ã†â€™ÃƒÂ¢Ã¢â€šÂ¬Ã…Â¡ÃƒÆ’Ã¢â‚¬Å¡Ãƒâ€šÃ‚Â¼g</w:t>
       </w:r>
       <w:proofErr w:type="spellEnd"/>
       <w:r>
@@ -8887,7 +8887,7 @@
           <w:sz w:val="28"/>
           <w:szCs w:val="28"/>
         </w:rPr>
-        <w:t>The bar chart illustrates the changes in phosphate (POÃƒÆ’Ã†â€™Ãƒâ€ Ã¢â‚¬â„¢ÃƒÆ’Ã¢â‚¬Â ÃƒÂ¢Ã¢â€šÂ¬Ã¢â€žÂ¢ÃƒÆ’Ã†â€™ÃƒÂ¢Ã¢â€šÂ¬Ã‚Â ÃƒÆ’Ã‚Â¢ÃƒÂ¢Ã¢â‚¬Å¡Ã‚Â¬ÃƒÂ¢Ã¢â‚¬Å¾Ã‚Â¢ÃƒÆ’Ã†â€™Ãƒâ€ Ã¢â‚¬â„¢ÃƒÆ’Ã‚Â¢ÃƒÂ¢Ã¢â‚¬Å¡Ã‚Â¬Ãƒâ€šÃ‚Â ÃƒÆ’Ã†â€™Ãƒâ€šÃ‚Â¢ÃƒÆ’Ã‚Â¢ÃƒÂ¢Ã¢â€šÂ¬Ã…Â¡Ãƒâ€šÃ‚Â¬ÃƒÆ’Ã‚Â¢ÃƒÂ¢Ã¢â€šÂ¬Ã…Â¾Ãƒâ€šÃ‚Â¢ÃƒÆ’Ã†â€™Ãƒâ€ Ã¢â‚¬â„¢ÃƒÆ’Ã¢â‚¬Â ÃƒÂ¢Ã¢â€šÂ¬Ã¢â€žÂ¢ÃƒÆ’Ã†â€™Ãƒâ€šÃ‚Â¢ÃƒÆ’Ã‚Â¢ÃƒÂ¢Ã¢â€šÂ¬Ã…Â¡Ãƒâ€šÃ‚Â¬ÃƒÆ’Ã¢â‚¬Å¡Ãƒâ€šÃ‚Â ÃƒÆ’Ã†â€™Ãƒâ€ Ã¢â‚¬â„¢ÃƒÆ’Ã¢â‚¬Å¡Ãƒâ€šÃ‚Â¢ÃƒÆ’Ã†â€™Ãƒâ€šÃ‚Â¢ÃƒÆ’Ã‚Â¢ÃƒÂ¢Ã¢â‚¬Å¡Ã‚Â¬Ãƒâ€¦Ã‚Â¡ÃƒÆ’Ã¢â‚¬Å¡Ãƒâ€šÃ‚Â¬ÃƒÆ’Ã†â€™Ãƒâ€šÃ‚Â¢ÃƒÆ’Ã‚Â¢ÃƒÂ¢Ã¢â‚¬Å¡Ã‚Â¬Ãƒâ€¦Ã‚Â¾ÃƒÆ’Ã¢â‚¬Å¡Ãƒâ€šÃ‚Â¢ÃƒÆ’Ã†â€™Ãƒâ€ Ã¢â‚¬â„¢ÃƒÆ’Ã¢â‚¬Â ÃƒÂ¢Ã¢â€šÂ¬Ã¢â€žÂ¢ÃƒÆ’Ã†â€™ÃƒÂ¢Ã¢â€šÂ¬Ã‚Â ÃƒÆ’Ã‚Â¢ÃƒÂ¢Ã¢â‚¬Å¡Ã‚Â¬ÃƒÂ¢Ã¢â‚¬Å¾Ã‚Â¢ÃƒÆ’Ã†â€™Ãƒâ€ Ã¢â‚¬â„¢ÃƒÆ’Ã¢â‚¬Å¡Ãƒâ€šÃ‚Â¢ÃƒÆ’Ã†â€™Ãƒâ€šÃ‚Â¢ÃƒÆ’Ã‚Â¢ÃƒÂ¢Ã¢â‚¬Å¡Ã‚Â¬Ãƒâ€¦Ã‚Â¡ÃƒÆ’Ã¢â‚¬Å¡Ãƒâ€šÃ‚Â¬ÃƒÆ’Ã†â€™ÃƒÂ¢Ã¢â€šÂ¬Ã‚Â¦ÃƒÆ’Ã¢â‚¬Å¡Ãƒâ€šÃ‚Â¡ÃƒÆ’Ã†â€™Ãƒâ€ Ã¢â‚¬â„¢ÃƒÆ’Ã¢â‚¬Â ÃƒÂ¢Ã¢â€šÂ¬Ã¢â€žÂ¢ÃƒÆ’Ã†â€™Ãƒâ€šÃ‚Â¢ÃƒÆ’Ã‚Â¢ÃƒÂ¢Ã¢â€šÂ¬Ã…Â¡Ãƒâ€šÃ‚Â¬ÃƒÆ’Ã¢â‚¬Â¦Ãƒâ€šÃ‚Â¡ÃƒÆ’Ã†â€™Ãƒâ€ Ã¢â‚¬â„¢ÃƒÆ’Ã‚Â¢ÃƒÂ¢Ã¢â‚¬Å¡Ã‚Â¬Ãƒâ€¦Ã‚Â¡ÃƒÆ’Ã†â€™ÃƒÂ¢Ã¢â€šÂ¬Ã…Â¡ÃƒÆ’Ã¢â‚¬Å¡Ãƒâ€šÃ‚Â¢ÃƒÆ’Ã†â€™Ãƒâ€ Ã¢â‚¬â„¢ÃƒÆ’Ã¢â‚¬Â ÃƒÂ¢Ã¢â€šÂ¬Ã¢â€žÂ¢ÃƒÆ’Ã†â€™ÃƒÂ¢Ã¢â€šÂ¬Ã‚Â ÃƒÆ’Ã‚Â¢ÃƒÂ¢Ã¢â‚¬Å¡Ã‚Â¬ÃƒÂ¢Ã¢â‚¬Å¾Ã‚Â¢ÃƒÆ’Ã†â€™Ãƒâ€ Ã¢â‚¬â„¢ÃƒÆ’Ã‚Â¢ÃƒÂ¢Ã¢â‚¬Å¡Ã‚Â¬Ãƒâ€šÃ‚Â ÃƒÆ’Ã†â€™Ãƒâ€šÃ‚Â¢ÃƒÆ’Ã‚Â¢ÃƒÂ¢Ã¢â€šÂ¬Ã…Â¡Ãƒâ€šÃ‚Â¬ÃƒÆ’Ã‚Â¢ÃƒÂ¢Ã¢â€šÂ¬Ã…Â¾Ãƒâ€šÃ‚Â¢ÃƒÆ’Ã†â€™Ãƒâ€ Ã¢â‚¬â„¢ÃƒÆ’Ã¢â‚¬Â ÃƒÂ¢Ã¢â€šÂ¬Ã¢â€žÂ¢ÃƒÆ’Ã†â€™Ãƒâ€šÃ‚Â¢ÃƒÆ’Ã‚Â¢ÃƒÂ¢Ã¢â€šÂ¬Ã…Â¡Ãƒâ€šÃ‚Â¬ÃƒÆ’Ã¢â‚¬Â¦Ãƒâ€šÃ‚Â¡ÃƒÆ’Ã†â€™Ãƒâ€ Ã¢â‚¬â„¢ÃƒÆ’Ã‚Â¢ÃƒÂ¢Ã¢â‚¬Å¡Ã‚Â¬Ãƒâ€¦Ã‚Â¡ÃƒÆ’Ã†â€™ÃƒÂ¢Ã¢â€šÂ¬Ã…Â¡ÃƒÆ’Ã¢â‚¬Å¡Ãƒâ€šÃ‚Â¢ÃƒÆ’Ã†â€™Ãƒâ€ Ã¢â‚¬â„¢ÃƒÆ’Ã¢â‚¬Â ÃƒÂ¢Ã¢â€šÂ¬Ã¢â€žÂ¢ÃƒÆ’Ã†â€™ÃƒÂ¢Ã¢â€šÂ¬Ã‚Â ÃƒÆ’Ã‚Â¢ÃƒÂ¢Ã¢â‚¬Å¡Ã‚Â¬ÃƒÂ¢Ã¢â‚¬Å¾Ã‚Â¢ÃƒÆ’Ã†â€™Ãƒâ€ Ã¢â‚¬â„¢ÃƒÆ’Ã‚Â¢ÃƒÂ¢Ã¢â‚¬Å¡Ã‚Â¬Ãƒâ€¦Ã‚Â¡ÃƒÆ’Ã†â€™ÃƒÂ¢Ã¢â€šÂ¬Ã…Â¡ÃƒÆ’Ã¢â‚¬Å¡Ãƒâ€šÃ‚Â¢ÃƒÆ’Ã†â€™Ãƒâ€ Ã¢â‚¬â„¢ÃƒÆ’Ã¢â‚¬Â ÃƒÂ¢Ã¢â€šÂ¬Ã¢â€žÂ¢ÃƒÆ’Ã†â€™ÃƒÂ¢Ã¢â€šÂ¬Ã…Â¡ÃƒÆ’Ã¢â‚¬Å¡Ãƒâ€šÃ‚Â¢ÃƒÆ’Ã†â€™Ãƒâ€ Ã¢â‚¬â„¢ÃƒÆ’Ã¢â‚¬Å¡Ãƒâ€šÃ‚Â¢ÃƒÆ’Ã†â€™Ãƒâ€šÃ‚Â¢ÃƒÆ’Ã‚Â¢ÃƒÂ¢Ã¢â€šÂ¬Ã…Â¡Ãƒâ€šÃ‚Â¬ÃƒÆ’Ã¢â‚¬Â¦Ãƒâ€šÃ‚Â¡ÃƒÆ’Ã†â€™ÃƒÂ¢Ã¢â€šÂ¬Ã…Â¡ÃƒÆ’Ã¢â‚¬Å¡Ãƒâ€šÃ‚Â¬ÃƒÆ’Ã†â€™Ãƒâ€ Ã¢â‚¬â„¢ÃƒÆ’Ã‚Â¢ÃƒÂ¢Ã¢â‚¬Å¡Ã‚Â¬Ãƒâ€šÃ‚Â¦ÃƒÆ’Ã†â€™ÃƒÂ¢Ã¢â€šÂ¬Ã…Â¡ÃƒÆ’Ã¢â‚¬Å¡Ãƒâ€šÃ‚Â¡ÃƒÆ’Ã†â€™Ãƒâ€ Ã¢â‚¬â„¢ÃƒÆ’Ã¢â‚¬Â ÃƒÂ¢Ã¢â€šÂ¬Ã¢â€žÂ¢ÃƒÆ’Ã†â€™Ãƒâ€šÃ‚Â¢ÃƒÆ’Ã‚Â¢ÃƒÂ¢Ã¢â€šÂ¬Ã…Â¡Ãƒâ€šÃ‚Â¬ÃƒÆ’Ã¢â‚¬Â¦Ãƒâ€šÃ‚Â¡ÃƒÆ’Ã†â€™Ãƒâ€ Ã¢â‚¬â„¢ÃƒÆ’Ã‚Â¢ÃƒÂ¢Ã¢â‚¬Å¡Ã‚Â¬Ãƒâ€¦Ã‚Â¡ÃƒÆ’Ã†â€™ÃƒÂ¢Ã¢â€šÂ¬Ã…Â¡ÃƒÆ’Ã¢â‚¬Å¡Ãƒâ€šÃ‚Â¬ÃƒÆ’Ã†â€™Ãƒâ€ Ã¢â‚¬â„¢ÃƒÆ’Ã¢â‚¬Â ÃƒÂ¢Ã¢â€šÂ¬Ã¢â€žÂ¢ÃƒÆ’Ã†â€™ÃƒÂ¢Ã¢â€šÂ¬Ã‚Â ÃƒÆ’Ã‚Â¢ÃƒÂ¢Ã¢â‚¬Å¡Ã‚Â¬ÃƒÂ¢Ã¢â‚¬Å¾Ã‚Â¢ÃƒÆ’Ã†â€™Ãƒâ€ Ã¢â‚¬â„¢ÃƒÆ’Ã¢â‚¬Å¡Ãƒâ€šÃ‚Â¢ÃƒÆ’Ã†â€™Ãƒâ€šÃ‚Â¢ÃƒÆ’Ã‚Â¢ÃƒÂ¢Ã¢â‚¬Å¡Ã‚Â¬Ãƒâ€¦Ã‚Â¡ÃƒÆ’Ã¢â‚¬Å¡Ãƒâ€šÃ‚Â¬ÃƒÆ’Ã†â€™ÃƒÂ¢Ã¢â€šÂ¬Ã…Â¡ÃƒÆ’Ã¢â‚¬Å¡Ãƒâ€šÃ‚Â¦ÃƒÆ’Ã†â€™Ãƒâ€ Ã¢â‚¬â„¢ÃƒÆ’Ã¢â‚¬Â ÃƒÂ¢Ã¢â€šÂ¬Ã¢â€žÂ¢ÃƒÆ’Ã†â€™Ãƒâ€šÃ‚Â¢ÃƒÆ’Ã‚Â¢ÃƒÂ¢Ã¢â€šÂ¬Ã…Â¡Ãƒâ€šÃ‚Â¬ÃƒÆ’Ã¢â‚¬Â¦Ãƒâ€šÃ‚Â¡ÃƒÆ’Ã†â€™Ãƒâ€ Ã¢â‚¬â„¢ÃƒÆ’Ã‚Â¢ÃƒÂ¢Ã¢â‚¬Å¡Ã‚Â¬Ãƒâ€¦Ã‚Â¡ÃƒÆ’Ã†â€™ÃƒÂ¢Ã¢â€šÂ¬Ã…Â¡ÃƒÆ’Ã¢â‚¬Å¡Ãƒâ€šÃ‚Â¡ÃƒÆ’Ã†â€™Ãƒâ€ Ã¢â‚¬â„¢ÃƒÆ’Ã¢â‚¬Â ÃƒÂ¢Ã¢â€šÂ¬Ã¢â€žÂ¢ÃƒÆ’Ã†â€™ÃƒÂ¢Ã¢â€šÂ¬Ã‚Â ÃƒÆ’Ã‚Â¢ÃƒÂ¢Ã¢â‚¬Å¡Ã‚Â¬ÃƒÂ¢Ã¢â‚¬Å¾Ã‚Â¢ÃƒÆ’Ã†â€™Ãƒâ€ Ã¢â‚¬â„¢ÃƒÆ’Ã‚Â¢ÃƒÂ¢Ã¢â‚¬Å¡Ã‚Â¬Ãƒâ€šÃ‚Â ÃƒÆ’Ã†â€™Ãƒâ€šÃ‚Â¢ÃƒÆ’Ã‚Â¢ÃƒÂ¢Ã¢â€šÂ¬Ã…Â¡Ãƒâ€šÃ‚Â¬ÃƒÆ’Ã‚Â¢ÃƒÂ¢Ã¢â€šÂ¬Ã…Â¾Ãƒâ€šÃ‚Â¢ÃƒÆ’Ã†â€™Ãƒâ€ Ã¢â‚¬â„¢ÃƒÆ’Ã¢â‚¬Â ÃƒÂ¢Ã¢â€šÂ¬Ã¢â€žÂ¢ÃƒÆ’Ã†â€™Ãƒâ€šÃ‚Â¢ÃƒÆ’Ã‚Â¢ÃƒÂ¢Ã¢â€šÂ¬Ã…Â¡Ãƒâ€šÃ‚Â¬ÃƒÆ’Ã¢â‚¬Â¦Ãƒâ€šÃ‚Â¡ÃƒÆ’Ã†â€™Ãƒâ€ Ã¢â‚¬â„¢ÃƒÆ’Ã‚Â¢ÃƒÂ¢Ã¢â‚¬Å¡Ã‚Â¬Ãƒâ€¦Ã‚Â¡ÃƒÆ’Ã†â€™ÃƒÂ¢Ã¢â€šÂ¬Ã…Â¡ÃƒÆ’Ã¢â‚¬Å¡Ãƒâ€šÃ‚Â¢ÃƒÆ’Ã†â€™Ãƒâ€ Ã¢â‚¬â„¢ÃƒÆ’Ã¢â‚¬Â ÃƒÂ¢Ã¢â€šÂ¬Ã¢â€žÂ¢ÃƒÆ’Ã†â€™ÃƒÂ¢Ã¢â€šÂ¬Ã‚Â ÃƒÆ’Ã‚Â¢ÃƒÂ¢Ã¢â‚¬Å¡Ã‚Â¬ÃƒÂ¢Ã¢â‚¬Å¾Ã‚Â¢ÃƒÆ’Ã†â€™Ãƒâ€ Ã¢â‚¬â„¢ÃƒÆ’Ã‚Â¢ÃƒÂ¢Ã¢â‚¬Å¡Ã‚Â¬Ãƒâ€¦Ã‚Â¡ÃƒÆ’Ã†â€™ÃƒÂ¢Ã¢â€šÂ¬Ã…Â¡ÃƒÆ’Ã¢â‚¬Å¡Ãƒâ€šÃ‚Â¢ÃƒÆ’Ã†â€™Ãƒâ€ Ã¢â‚¬â„¢ÃƒÆ’Ã¢â‚¬Â ÃƒÂ¢Ã¢â€šÂ¬Ã¢â€žÂ¢ÃƒÆ’Ã†â€™ÃƒÂ¢Ã¢â€šÂ¬Ã…Â¡ÃƒÆ’Ã¢â‚¬Å¡Ãƒâ€šÃ‚Â¢ÃƒÆ’Ã†â€™Ãƒâ€ Ã¢â‚¬â„¢ÃƒÆ’Ã¢â‚¬Å¡Ãƒâ€šÃ‚Â¢ÃƒÆ’Ã†â€™Ãƒâ€šÃ‚Â¢ÃƒÆ’Ã‚Â¢ÃƒÂ¢Ã¢â€šÂ¬Ã…Â¡Ãƒâ€šÃ‚Â¬ÃƒÆ’Ã¢â‚¬Â¦Ãƒâ€šÃ‚Â¡ÃƒÆ’Ã†â€™ÃƒÂ¢Ã¢â€šÂ¬Ã…Â¡ÃƒÆ’Ã¢â‚¬Å¡Ãƒâ€šÃ‚Â¬ÃƒÆ’Ã†â€™Ãƒâ€ Ã¢â‚¬â„¢ÃƒÆ’Ã‚Â¢ÃƒÂ¢Ã¢â‚¬Å¡Ã‚Â¬Ãƒâ€šÃ‚Â¦ÃƒÆ’Ã†â€™ÃƒÂ¢Ã¢â€šÂ¬Ã…Â¡ÃƒÆ’Ã¢â‚¬Å¡Ãƒâ€šÃ‚Â¡ÃƒÆ’Ã†â€™Ãƒâ€ Ã¢â‚¬â„¢ÃƒÆ’Ã¢â‚¬Â ÃƒÂ¢Ã¢â€šÂ¬Ã¢â€žÂ¢ÃƒÆ’Ã†â€™Ãƒâ€šÃ‚Â¢ÃƒÆ’Ã‚Â¢ÃƒÂ¢Ã¢â€šÂ¬Ã…Â¡Ãƒâ€šÃ‚Â¬ÃƒÆ’Ã¢â‚¬Â¦Ãƒâ€šÃ‚Â¡ÃƒÆ’Ã†â€™Ãƒâ€ Ã¢â‚¬â„¢ÃƒÆ’Ã‚Â¢ÃƒÂ¢Ã¢â‚¬Å¡Ã‚Â¬Ãƒâ€¦Ã‚Â¡ÃƒÆ’Ã†â€™ÃƒÂ¢Ã¢â€šÂ¬Ã…Â¡ÃƒÆ’Ã¢â‚¬Å¡Ãƒâ€šÃ‚Â¬ÃƒÆ’Ã†â€™Ãƒâ€ Ã¢â‚¬â„¢ÃƒÆ’Ã¢â‚¬Â ÃƒÂ¢Ã¢â€šÂ¬Ã¢â€žÂ¢ÃƒÆ’Ã†â€™ÃƒÂ¢Ã¢â€šÂ¬Ã‚Â ÃƒÆ’Ã‚Â¢ÃƒÂ¢Ã¢â‚¬Å¡Ã‚Â¬ÃƒÂ¢Ã¢â‚¬Å¾Ã‚Â¢ÃƒÆ’Ã†â€™Ãƒâ€ Ã¢â‚¬â„¢ÃƒÆ’Ã¢â‚¬Å¡Ãƒâ€šÃ‚Â¢ÃƒÆ’Ã†â€™Ãƒâ€šÃ‚Â¢ÃƒÆ’Ã‚Â¢ÃƒÂ¢Ã¢â‚¬Å¡Ã‚Â¬Ãƒâ€¦Ã‚Â¡ÃƒÆ’Ã¢â‚¬Å¡Ãƒâ€šÃ‚Â¬ÃƒÆ’Ã†â€™ÃƒÂ¢Ã¢â€šÂ¬Ã…Â¡ÃƒÆ’Ã¢â‚¬Å¡Ãƒâ€šÃ‚Â¦ÃƒÆ’Ã†â€™Ãƒâ€ Ã¢â‚¬â„¢ÃƒÆ’Ã¢â‚¬Â ÃƒÂ¢Ã¢â€šÂ¬Ã¢â€žÂ¢ÃƒÆ’Ã†â€™Ãƒâ€šÃ‚Â¢ÃƒÆ’Ã‚Â¢ÃƒÂ¢Ã¢â€šÂ¬Ã…Â¡Ãƒâ€šÃ‚Â¬ÃƒÆ’Ã¢â‚¬Â¦Ãƒâ€šÃ‚Â¡ÃƒÆ’Ã†â€™Ãƒâ€ Ã¢â‚¬â„¢ÃƒÆ’Ã‚Â¢ÃƒÂ¢Ã¢â‚¬Å¡Ã‚Â¬Ãƒâ€¦Ã‚Â¡ÃƒÆ’Ã†â€™ÃƒÂ¢Ã¢â€šÂ¬Ã…Â¡ÃƒÆ’Ã¢â‚¬Å¡Ãƒâ€šÃ‚Â¾ÃƒÆ’Ã†â€™Ãƒâ€ Ã¢â‚¬â„¢ÃƒÆ’Ã¢â‚¬Â ÃƒÂ¢Ã¢â€šÂ¬Ã¢â€žÂ¢ÃƒÆ’Ã†â€™ÃƒÂ¢Ã¢â€šÂ¬Ã‚Â ÃƒÆ’Ã‚Â¢ÃƒÂ¢Ã¢â‚¬Å¡Ã‚Â¬ÃƒÂ¢Ã¢â‚¬Å¾Ã‚Â¢ÃƒÆ’Ã†â€™Ãƒâ€ Ã¢â‚¬â„¢ÃƒÆ’Ã‚Â¢ÃƒÂ¢Ã¢â‚¬Å¡Ã‚Â¬Ãƒâ€šÃ‚Â ÃƒÆ’Ã†â€™Ãƒâ€šÃ‚Â¢ÃƒÆ’Ã‚Â¢ÃƒÂ¢Ã¢â€šÂ¬Ã…Â¡Ãƒâ€šÃ‚Â¬ÃƒÆ’Ã‚Â¢ÃƒÂ¢Ã¢â€šÂ¬Ã…Â¾Ãƒâ€šÃ‚Â¢ÃƒÆ’Ã†â€™Ãƒâ€ Ã¢â‚¬â„¢ÃƒÆ’Ã¢â‚¬Â ÃƒÂ¢Ã¢â€šÂ¬Ã¢â€žÂ¢ÃƒÆ’Ã†â€™Ãƒâ€šÃ‚Â¢ÃƒÆ’Ã‚Â¢ÃƒÂ¢Ã¢â€šÂ¬Ã…Â¡Ãƒâ€šÃ‚Â¬ÃƒÆ’Ã¢â‚¬Å¡Ãƒâ€šÃ‚Â ÃƒÆ’Ã†â€™Ãƒâ€ Ã¢â‚¬â„¢ÃƒÆ’Ã¢â‚¬Å¡Ãƒâ€šÃ‚Â¢ÃƒÆ’Ã†â€™Ãƒâ€šÃ‚Â¢ÃƒÆ’Ã‚Â¢ÃƒÂ¢Ã¢â‚¬Å¡Ã‚Â¬Ãƒâ€¦Ã‚Â¡ÃƒÆ’Ã¢â‚¬Å¡Ãƒâ€šÃ‚Â¬ÃƒÆ’Ã†â€™Ãƒâ€šÃ‚Â¢ÃƒÆ’Ã‚Â¢ÃƒÂ¢Ã¢â‚¬Å¡Ã‚Â¬Ãƒâ€¦Ã‚Â¾ÃƒÆ’Ã¢â‚¬Å¡Ãƒâ€šÃ‚Â¢ÃƒÆ’Ã†â€™Ãƒâ€ Ã¢â‚¬â„¢ÃƒÆ’Ã¢â‚¬Â ÃƒÂ¢Ã¢â€šÂ¬Ã¢â€žÂ¢ÃƒÆ’Ã†â€™ÃƒÂ¢Ã¢â€šÂ¬Ã‚Â ÃƒÆ’Ã‚Â¢ÃƒÂ¢Ã¢â‚¬Å¡Ã‚Â¬ÃƒÂ¢Ã¢â‚¬Å¾Ã‚Â¢ÃƒÆ’Ã†â€™Ãƒâ€ Ã¢â‚¬â„¢ÃƒÆ’Ã‚Â¢ÃƒÂ¢Ã¢â‚¬Å¡Ã‚Â¬Ãƒâ€¦Ã‚Â¡ÃƒÆ’Ã†â€™ÃƒÂ¢Ã¢â€šÂ¬Ã…Â¡ÃƒÆ’Ã¢â‚¬Å¡Ãƒâ€šÃ‚Â¢ÃƒÆ’Ã†â€™Ãƒâ€ Ã¢â‚¬â„¢ÃƒÆ’Ã¢â‚¬Â ÃƒÂ¢Ã¢â€šÂ¬Ã¢â€žÂ¢ÃƒÆ’Ã†â€™ÃƒÂ¢Ã¢â€šÂ¬Ã…Â¡ÃƒÆ’Ã¢â‚¬Å¡Ãƒâ€šÃ‚Â¢ÃƒÆ’Ã†â€™Ãƒâ€ Ã¢â‚¬â„¢ÃƒÆ’Ã¢â‚¬Å¡Ãƒâ€šÃ‚Â¢ÃƒÆ’Ã†â€™Ãƒâ€šÃ‚Â¢ÃƒÆ’Ã‚Â¢ÃƒÂ¢Ã¢â‚¬Å¡Ã‚Â¬Ãƒâ€¦Ã‚Â¡ÃƒÆ’Ã¢â‚¬Å¡Ãƒâ€šÃ‚Â¬ÃƒÆ’Ã†â€™ÃƒÂ¢Ã¢â€šÂ¬Ã‚Â¦ÃƒÆ’Ã¢â‚¬Å¡Ãƒâ€šÃ‚Â¡ÃƒÆ’Ã†â€™Ãƒâ€ Ã¢â‚¬â„¢ÃƒÆ’Ã‚Â¢ÃƒÂ¢Ã¢â‚¬Å¡Ã‚Â¬Ãƒâ€¦Ã‚Â¡ÃƒÆ’Ã†â€™ÃƒÂ¢Ã¢â€šÂ¬Ã…Â¡ÃƒÆ’Ã¢â‚¬Å¡Ãƒâ€šÃ‚Â¬ÃƒÆ’Ã†â€™Ãƒâ€ Ã¢â‚¬â„¢ÃƒÆ’Ã¢â‚¬Â ÃƒÂ¢Ã¢â€šÂ¬Ã¢â€žÂ¢ÃƒÆ’Ã†â€™Ãƒâ€šÃ‚Â¢ÃƒÆ’Ã‚Â¢ÃƒÂ¢Ã¢â€šÂ¬Ã…Â¡Ãƒâ€šÃ‚Â¬ÃƒÆ’Ã¢â‚¬Å¡Ãƒâ€šÃ‚Â¦ÃƒÆ’Ã†â€™Ãƒâ€ Ã¢â‚¬â„¢ÃƒÆ’Ã‚Â¢ÃƒÂ¢Ã¢â‚¬Å¡Ã‚Â¬Ãƒâ€¦Ã‚Â¡ÃƒÆ’Ã†â€™ÃƒÂ¢Ã¢â€šÂ¬Ã…Â¡ÃƒÆ’Ã¢â‚¬Å¡Ãƒâ€šÃ‚Â¡ÃƒÆ’Ã†â€™Ãƒâ€ Ã¢â‚¬â„¢ÃƒÆ’Ã¢â‚¬Â ÃƒÂ¢Ã¢â€šÂ¬Ã¢â€žÂ¢ÃƒÆ’Ã†â€™ÃƒÂ¢Ã¢â€šÂ¬Ã‚Â ÃƒÆ’Ã‚Â¢ÃƒÂ¢Ã¢â‚¬Å¡Ã‚Â¬ÃƒÂ¢Ã¢â‚¬Å¾Ã‚Â¢ÃƒÆ’Ã†â€™Ãƒâ€ Ã¢â‚¬â„¢ÃƒÆ’Ã‚Â¢ÃƒÂ¢Ã¢â‚¬Å¡Ã‚Â¬Ãƒâ€šÃ‚Â ÃƒÆ’Ã†â€™Ãƒâ€šÃ‚Â¢ÃƒÆ’Ã‚Â¢ÃƒÂ¢Ã¢â€šÂ¬Ã…Â¡Ãƒâ€šÃ‚Â¬ÃƒÆ’Ã‚Â¢ÃƒÂ¢Ã¢â€šÂ¬Ã…Â¾Ãƒâ€šÃ‚Â¢ÃƒÆ’Ã†â€™Ãƒâ€ Ã¢â‚¬â„¢ÃƒÆ’Ã¢â‚¬Â ÃƒÂ¢Ã¢â€šÂ¬Ã¢â€žÂ¢ÃƒÆ’Ã†â€™ÃƒÂ¢Ã¢â€šÂ¬Ã…Â¡ÃƒÆ’Ã¢â‚¬Å¡Ãƒâ€šÃ‚Â¢ÃƒÆ’Ã†â€™Ãƒâ€ Ã¢â‚¬â„¢ÃƒÆ’Ã¢â‚¬Å¡Ãƒâ€šÃ‚Â¢ÃƒÆ’Ã†â€™Ãƒâ€šÃ‚Â¢ÃƒÆ’Ã‚Â¢ÃƒÂ¢Ã¢â€šÂ¬Ã…Â¡Ãƒâ€šÃ‚Â¬ÃƒÆ’Ã¢â‚¬Â¦Ãƒâ€šÃ‚Â¡ÃƒÆ’Ã†â€™ÃƒÂ¢Ã¢â€šÂ¬Ã…Â¡ÃƒÆ’Ã¢â‚¬Å¡Ãƒâ€šÃ‚Â¬ÃƒÆ’Ã†â€™Ãƒâ€ Ã¢â‚¬â„¢ÃƒÆ’Ã‚Â¢ÃƒÂ¢Ã¢â‚¬Å¡Ã‚Â¬Ãƒâ€šÃ‚Â¦ÃƒÆ’Ã†â€™ÃƒÂ¢Ã¢â€šÂ¬Ã…Â¡ÃƒÆ’Ã¢â‚¬Å¡Ãƒâ€šÃ‚Â¡ÃƒÆ’Ã†â€™Ãƒâ€ Ã¢â‚¬â„¢ÃƒÆ’Ã¢â‚¬Â ÃƒÂ¢Ã¢â€šÂ¬Ã¢â€žÂ¢ÃƒÆ’Ã†â€™ÃƒÂ¢Ã¢â€šÂ¬Ã‚Â ÃƒÆ’Ã‚Â¢ÃƒÂ¢Ã¢â‚¬Å¡Ã‚Â¬ÃƒÂ¢Ã¢â‚¬Å¾Ã‚Â¢ÃƒÆ’Ã†â€™Ãƒâ€ Ã¢â‚¬â„¢ÃƒÆ’Ã¢â‚¬Å¡Ãƒâ€šÃ‚Â¢ÃƒÆ’Ã†â€™Ãƒâ€šÃ‚Â¢ÃƒÆ’Ã‚Â¢ÃƒÂ¢Ã¢â‚¬Å¡Ã‚Â¬Ãƒâ€¦Ã‚Â¡ÃƒÆ’Ã¢â‚¬Å¡Ãƒâ€šÃ‚Â¬ÃƒÆ’Ã†â€™ÃƒÂ¢Ã¢â€šÂ¬Ã‚Â¦ÃƒÆ’Ã¢â‚¬Å¡Ãƒâ€šÃ‚Â¡ÃƒÆ’Ã†â€™Ãƒâ€ Ã¢â‚¬â„¢ÃƒÆ’Ã¢â‚¬Â ÃƒÂ¢Ã¢â€šÂ¬Ã¢â€žÂ¢ÃƒÆ’Ã†â€™Ãƒâ€šÃ‚Â¢ÃƒÆ’Ã‚Â¢ÃƒÂ¢Ã¢â€šÂ¬Ã…Â¡Ãƒâ€šÃ‚Â¬ÃƒÆ’Ã¢â‚¬Â¦Ãƒâ€šÃ‚Â¡ÃƒÆ’Ã†â€™Ãƒâ€ Ã¢â‚¬â„¢ÃƒÆ’Ã‚Â¢ÃƒÂ¢Ã¢â‚¬Å¡Ã‚Â¬Ãƒâ€¦Ã‚Â¡ÃƒÆ’Ã†â€™ÃƒÂ¢Ã¢â€šÂ¬Ã…Â¡ÃƒÆ’Ã¢â‚¬Å¡Ãƒâ€šÃ‚Â³ÃƒÆ’Ã†â€™Ãƒâ€ Ã¢â‚¬â„¢ÃƒÆ’Ã¢â‚¬Â ÃƒÂ¢Ã¢â€šÂ¬Ã¢â€žÂ¢ÃƒÆ’Ã†â€™ÃƒÂ¢Ã¢â€šÂ¬Ã‚Â ÃƒÆ’Ã‚Â¢ÃƒÂ¢Ã¢â‚¬Å¡Ã‚Â¬ÃƒÂ¢Ã¢â‚¬Å¾Ã‚Â¢ÃƒÆ’Ã†â€™Ãƒâ€ Ã¢â‚¬â„¢ÃƒÆ’Ã‚Â¢ÃƒÂ¢Ã¢â‚¬Å¡Ã‚Â¬Ãƒâ€šÃ‚Â ÃƒÆ’Ã†â€™Ãƒâ€šÃ‚Â¢ÃƒÆ’Ã‚Â¢ÃƒÂ¢Ã¢â€šÂ¬Ã…Â¡Ãƒâ€šÃ‚Â¬ÃƒÆ’Ã‚Â¢ÃƒÂ¢Ã¢â€šÂ¬Ã…Â¾Ãƒâ€šÃ‚Â¢ÃƒÆ’Ã†â€™Ãƒâ€ Ã¢â‚¬â„¢ÃƒÆ’Ã¢â‚¬Â ÃƒÂ¢Ã¢â€šÂ¬Ã¢â€žÂ¢ÃƒÆ’Ã†â€™Ãƒâ€šÃ‚Â¢ÃƒÆ’Ã‚Â¢ÃƒÂ¢Ã¢â€šÂ¬Ã…Â¡Ãƒâ€šÃ‚Â¬ÃƒÆ’Ã¢â‚¬Å¡Ãƒâ€šÃ‚Â ÃƒÆ’Ã†â€™Ãƒâ€ Ã¢â‚¬â„¢ÃƒÆ’Ã¢â‚¬Å¡Ãƒâ€šÃ‚Â¢ÃƒÆ’Ã†â€™Ãƒâ€šÃ‚Â¢ÃƒÆ’Ã‚Â¢ÃƒÂ¢Ã¢â‚¬Å¡Ã‚Â¬Ãƒâ€¦Ã‚Â¡ÃƒÆ’Ã¢â‚¬Å¡Ãƒâ€šÃ‚Â¬ÃƒÆ’Ã†â€™Ãƒâ€šÃ‚Â¢ÃƒÆ’Ã‚Â¢ÃƒÂ¢Ã¢â‚¬Å¡Ã‚Â¬Ãƒâ€¦Ã‚Â¾ÃƒÆ’Ã¢â‚¬Å¡Ãƒâ€šÃ‚Â¢ÃƒÆ’Ã†â€™Ãƒâ€ Ã¢â‚¬â„¢ÃƒÆ’Ã¢â‚¬Â ÃƒÂ¢Ã¢â€šÂ¬Ã¢â€žÂ¢ÃƒÆ’Ã†â€™ÃƒÂ¢Ã¢â€šÂ¬Ã‚Â ÃƒÆ’Ã‚Â¢ÃƒÂ¢Ã¢â‚¬Å¡Ã‚Â¬ÃƒÂ¢Ã¢â‚¬Å¾Ã‚Â¢ÃƒÆ’Ã†â€™Ãƒâ€ Ã¢â‚¬â„¢ÃƒÆ’Ã¢â‚¬Å¡Ãƒâ€šÃ‚Â¢ÃƒÆ’Ã†â€™Ãƒâ€šÃ‚Â¢ÃƒÆ’Ã‚Â¢ÃƒÂ¢Ã¢â‚¬Å¡Ã‚Â¬Ãƒâ€¦Ã‚Â¡ÃƒÆ’Ã¢â‚¬Å¡Ãƒâ€šÃ‚Â¬ÃƒÆ’Ã†â€™ÃƒÂ¢Ã¢â€šÂ¬Ã‚Â¦ÃƒÆ’Ã¢â‚¬Å¡Ãƒâ€šÃ‚Â¡ÃƒÆ’Ã†â€™Ãƒâ€ Ã¢â‚¬â„¢ÃƒÆ’Ã¢â‚¬Â ÃƒÂ¢Ã¢â€šÂ¬Ã¢â€žÂ¢ÃƒÆ’Ã†â€™Ãƒâ€šÃ‚Â¢ÃƒÆ’Ã‚Â¢ÃƒÂ¢Ã¢â€šÂ¬Ã…Â¡Ãƒâ€šÃ‚Â¬ÃƒÆ’Ã¢â‚¬Â¦Ãƒâ€šÃ‚Â¡ÃƒÆ’Ã†â€™Ãƒâ€ Ã¢â‚¬â„¢ÃƒÆ’Ã‚Â¢ÃƒÂ¢Ã¢â‚¬Å¡Ã‚Â¬Ãƒâ€¦Ã‚Â¡ÃƒÆ’Ã†â€™ÃƒÂ¢Ã¢â€šÂ¬Ã…Â¡ÃƒÆ’Ã¢â‚¬Å¡Ãƒâ€šÃ‚Â¢ÃƒÆ’Ã†â€™Ãƒâ€ Ã¢â‚¬â„¢ÃƒÆ’Ã¢â‚¬Â ÃƒÂ¢Ã¢â€šÂ¬Ã¢â€žÂ¢ÃƒÆ’Ã†â€™ÃƒÂ¢Ã¢â€šÂ¬Ã‚Â ÃƒÆ’Ã‚Â¢ÃƒÂ¢Ã¢â‚¬Å¡Ã‚Â¬ÃƒÂ¢Ã¢â‚¬Å¾Ã‚Â¢ÃƒÆ’Ã†â€™Ãƒâ€ Ã¢â‚¬â„¢ÃƒÆ’Ã‚Â¢ÃƒÂ¢Ã¢â‚¬Å¡Ã‚Â¬Ãƒâ€šÃ‚Â ÃƒÆ’Ã†â€™Ãƒâ€šÃ‚Â¢ÃƒÆ’Ã‚Â¢ÃƒÂ¢Ã¢â€šÂ¬Ã…Â¡Ãƒâ€šÃ‚Â¬ÃƒÆ’Ã‚Â¢ÃƒÂ¢Ã¢â€šÂ¬Ã…Â¾Ãƒâ€šÃ‚Â¢ÃƒÆ’Ã†â€™Ãƒâ€ Ã¢â‚¬â„¢ÃƒÆ’Ã¢â‚¬Â ÃƒÂ¢Ã¢â€šÂ¬Ã¢â€žÂ¢ÃƒÆ’Ã†â€™ÃƒÂ¢Ã¢â€šÂ¬Ã…Â¡ÃƒÆ’Ã¢â‚¬Å¡Ãƒâ€šÃ‚Â¢ÃƒÆ’Ã†â€™Ãƒâ€ Ã¢â‚¬â„¢ÃƒÆ’Ã¢â‚¬Å¡Ãƒâ€šÃ‚Â¢ÃƒÆ’Ã†â€™Ãƒâ€šÃ‚Â¢ÃƒÆ’Ã‚Â¢ÃƒÂ¢Ã¢â€šÂ¬Ã…Â¡Ãƒâ€šÃ‚Â¬ÃƒÆ’Ã¢â‚¬Â¦Ãƒâ€šÃ‚Â¡ÃƒÆ’Ã†â€™ÃƒÂ¢Ã¢â€šÂ¬Ã…Â¡ÃƒÆ’Ã¢â‚¬Å¡Ãƒâ€šÃ‚Â¬ÃƒÆ’Ã†â€™Ãƒâ€ Ã¢â‚¬â„¢ÃƒÆ’Ã‚Â¢ÃƒÂ¢Ã¢â‚¬Å¡Ã‚Â¬Ãƒâ€šÃ‚Â¦ÃƒÆ’Ã†â€™ÃƒÂ¢Ã¢â€šÂ¬Ã…Â¡ÃƒÆ’Ã¢â‚¬Å¡Ãƒâ€šÃ‚Â¡ÃƒÆ’Ã†â€™Ãƒâ€ Ã¢â‚¬â„¢ÃƒÆ’Ã¢â‚¬Â ÃƒÂ¢Ã¢â€šÂ¬Ã¢â€žÂ¢ÃƒÆ’Ã†â€™ÃƒÂ¢Ã¢â€šÂ¬Ã‚Â ÃƒÆ’Ã‚Â¢ÃƒÂ¢Ã¢â‚¬Å¡Ã‚Â¬ÃƒÂ¢Ã¢â‚¬Å¾Ã‚Â¢ÃƒÆ’Ã†â€™Ãƒâ€ Ã¢â‚¬â„¢ÃƒÆ’Ã¢â‚¬Å¡Ãƒâ€šÃ‚Â¢ÃƒÆ’Ã†â€™Ãƒâ€šÃ‚Â¢ÃƒÆ’Ã‚Â¢ÃƒÂ¢Ã¢â‚¬Å¡Ã‚Â¬Ãƒâ€¦Ã‚Â¡ÃƒÆ’Ã¢â‚¬Å¡Ãƒâ€šÃ‚Â¬ÃƒÆ’Ã†â€™ÃƒÂ¢Ã¢â€šÂ¬Ã‚Â¦ÃƒÆ’Ã¢â‚¬Å¡Ãƒâ€šÃ‚Â¡ÃƒÆ’Ã†â€™Ãƒâ€ Ã¢â‚¬â„¢ÃƒÆ’Ã¢â‚¬Â ÃƒÂ¢Ã¢â€šÂ¬Ã¢â€žÂ¢ÃƒÆ’Ã†â€™Ãƒâ€šÃ‚Â¢ÃƒÆ’Ã‚Â¢ÃƒÂ¢Ã¢â€šÂ¬Ã…Â¡Ãƒâ€šÃ‚Â¬ÃƒÆ’Ã¢â‚¬Â¦Ãƒâ€šÃ‚Â¡ÃƒÆ’Ã†â€™Ãƒâ€ Ã¢â‚¬â„¢ÃƒÆ’Ã‚Â¢ÃƒÂ¢Ã¢â‚¬Å¡Ã‚Â¬Ãƒâ€¦Ã‚Â¡ÃƒÆ’Ã†â€™ÃƒÂ¢Ã¢â€šÂ¬Ã…Â¡ÃƒÆ’Ã¢â‚¬Å¡Ãƒâ€šÃ‚ÂÃƒÆ’Ã†â€™Ãƒâ€ Ã¢â‚¬â„¢ÃƒÆ’Ã¢â‚¬Â ÃƒÂ¢Ã¢â€šÂ¬Ã¢â€žÂ¢ÃƒÆ’Ã†â€™ÃƒÂ¢Ã¢â€šÂ¬Ã‚Â ÃƒÆ’Ã‚Â¢ÃƒÂ¢Ã¢â‚¬Å¡Ã‚Â¬ÃƒÂ¢Ã¢â‚¬Å¾Ã‚Â¢ÃƒÆ’Ã†â€™Ãƒâ€ Ã¢â‚¬â„¢ÃƒÆ’Ã‚Â¢ÃƒÂ¢Ã¢â‚¬Å¡Ã‚Â¬Ãƒâ€šÃ‚Â ÃƒÆ’Ã†â€™Ãƒâ€šÃ‚Â¢ÃƒÆ’Ã‚Â¢ÃƒÂ¢Ã¢â€šÂ¬Ã…Â¡Ãƒâ€šÃ‚Â¬ÃƒÆ’Ã‚Â¢ÃƒÂ¢Ã¢â€šÂ¬Ã…Â¾Ãƒâ€šÃ‚Â¢ÃƒÆ’Ã†â€™Ãƒâ€ Ã¢â‚¬â„¢ÃƒÆ’Ã¢â‚¬Â ÃƒÂ¢Ã¢â€šÂ¬Ã¢â€žÂ¢ÃƒÆ’Ã†â€™ÃƒÂ¢Ã¢â€šÂ¬Ã…Â¡ÃƒÆ’Ã¢â‚¬Å¡Ãƒâ€šÃ‚Â¢ÃƒÆ’Ã†â€™Ãƒâ€ Ã¢â‚¬â„¢ÃƒÆ’Ã¢â‚¬Å¡Ãƒâ€šÃ‚Â¢ÃƒÆ’Ã†â€™Ãƒâ€šÃ‚Â¢ÃƒÆ’Ã‚Â¢ÃƒÂ¢Ã¢â€šÂ¬Ã…Â¡Ãƒâ€šÃ‚Â¬ÃƒÆ’Ã¢â‚¬Â¦Ãƒâ€šÃ‚Â¡ÃƒÆ’Ã†â€™ÃƒÂ¢Ã¢â€šÂ¬Ã…Â¡ÃƒÆ’Ã¢â‚¬Å¡Ãƒâ€šÃ‚Â¬ÃƒÆ’Ã†â€™Ãƒâ€ Ã¢â‚¬â„¢ÃƒÆ’Ã‚Â¢ÃƒÂ¢Ã¢â‚¬Å¡Ã‚Â¬Ãƒâ€šÃ‚Â¦ÃƒÆ’Ã†â€™ÃƒÂ¢Ã¢â€šÂ¬Ã…Â¡ÃƒÆ’Ã¢â‚¬Å¡Ãƒâ€šÃ‚Â¡ÃƒÆ’Ã†â€™Ãƒâ€ Ã¢â‚¬â„¢ÃƒÆ’Ã¢â‚¬Â ÃƒÂ¢Ã¢â€šÂ¬Ã¢â€žÂ¢ÃƒÆ’Ã†â€™ÃƒÂ¢Ã¢â€šÂ¬Ã‚Â ÃƒÆ’Ã‚Â¢ÃƒÂ¢Ã¢â‚¬Å¡Ã‚Â¬ÃƒÂ¢Ã¢â‚¬Å¾Ã‚Â¢ÃƒÆ’Ã†â€™Ãƒâ€ Ã¢â‚¬â„¢ÃƒÆ’Ã¢â‚¬Å¡Ãƒâ€šÃ‚Â¢ÃƒÆ’Ã†â€™Ãƒâ€šÃ‚Â¢ÃƒÆ’Ã‚Â¢ÃƒÂ¢Ã¢â‚¬Å¡Ã‚Â¬Ãƒâ€¦Ã‚Â¡ÃƒÆ’Ã¢â‚¬Å¡Ãƒâ€šÃ‚Â¬ÃƒÆ’Ã†â€™ÃƒÂ¢Ã¢â€šÂ¬Ã‚Â¦ÃƒÆ’Ã¢â‚¬Å¡Ãƒâ€šÃ‚Â¡ÃƒÆ’Ã†â€™Ãƒâ€ Ã¢â‚¬â„¢ÃƒÆ’Ã¢â‚¬Â ÃƒÂ¢Ã¢â€šÂ¬Ã¢â€žÂ¢ÃƒÆ’Ã†â€™Ãƒâ€šÃ‚Â¢ÃƒÆ’Ã‚Â¢ÃƒÂ¢Ã¢â€šÂ¬Ã…Â¡Ãƒâ€šÃ‚Â¬ÃƒÆ’Ã¢â‚¬Â¦Ãƒâ€šÃ‚Â¡ÃƒÆ’Ã†â€™Ãƒâ€ Ã¢â‚¬â„¢ÃƒÆ’Ã‚Â¢ÃƒÂ¢Ã¢â‚¬Å¡Ã‚Â¬Ãƒâ€¦Ã‚Â¡ÃƒÆ’Ã†â€™ÃƒÂ¢Ã¢â€šÂ¬Ã…Â¡ÃƒÆ’Ã¢â‚¬Å¡Ãƒâ€šÃ‚Â») concentration (</w:t>
+        <w:t>The bar chart illustrates the changes in phosphate (POÃƒÆ’Ã†â€™Ãƒâ€ Ã¢â‚¬â„¢ÃƒÆ’Ã¢â‚¬Â ÃƒÂ¢Ã¢â€šÂ¬Ã¢â€žÂ¢ÃƒÆ’Ã†â€™ÃƒÂ¢Ã¢â€šÂ¬Ã‚Â ÃƒÆ’Ã‚Â¢ÃƒÂ¢Ã¢â‚¬Å¡Ã‚Â¬ÃƒÂ¢Ã¢â‚¬Å¾Ã‚Â¢ÃƒÆ’Ã†â€™Ãƒâ€ Ã¢â‚¬â„¢ÃƒÆ’Ã‚Â¢ÃƒÂ¢Ã¢â‚¬Å¡Ã‚Â¬Ãƒâ€šÃ‚Â ÃƒÆ’Ã†â€™Ãƒâ€šÃ‚Â¢ÃƒÆ’Ã‚Â¢ÃƒÂ¢Ã¢â€šÂ¬Ã…Â¡Ãƒâ€šÃ‚Â¬ÃƒÆ’Ã‚Â¢ÃƒÂ¢Ã¢â€šÂ¬Ã…Â¾Ãƒâ€šÃ‚Â¢ÃƒÆ’Ã†â€™Ãƒâ€ Ã¢â‚¬â„¢ÃƒÆ’Ã¢â‚¬Â ÃƒÂ¢Ã¢â€šÂ¬Ã¢â€žÂ¢ÃƒÆ’Ã†â€™Ãƒâ€šÃ‚Â¢ÃƒÆ’Ã‚Â¢ÃƒÂ¢Ã¢â€šÂ¬Ã…Â¡Ãƒâ€šÃ‚Â¬ÃƒÆ’Ã¢â‚¬Å¡Ãƒâ€šÃ‚Â ÃƒÆ’Ã†â€™Ãƒâ€ Ã¢â‚¬â„¢ÃƒÆ’Ã¢â‚¬Å¡Ãƒâ€šÃ‚Â¢ÃƒÆ’Ã†â€™Ãƒâ€šÃ‚Â¢ÃƒÆ’Ã‚Â¢ÃƒÂ¢Ã¢â‚¬Å¡Ã‚Â¬Ãƒâ€¦Ã‚Â¡ÃƒÆ’Ã¢â‚¬Å¡Ãƒâ€šÃ‚Â¬ÃƒÆ’Ã†â€™Ãƒâ€šÃ‚Â¢ÃƒÆ’Ã‚Â¢ÃƒÂ¢Ã¢â‚¬Å¡Ã‚Â¬Ãƒâ€¦Ã‚Â¾ÃƒÆ’Ã¢â‚¬Å¡Ãƒâ€šÃ‚Â¢ÃƒÆ’Ã†â€™Ãƒâ€ Ã¢â‚¬â„¢ÃƒÆ’Ã¢â‚¬Â ÃƒÂ¢Ã¢â€šÂ¬Ã¢â€žÂ¢ÃƒÆ’Ã†â€™ÃƒÂ¢Ã¢â€šÂ¬Ã‚Â ÃƒÆ’Ã‚Â¢ÃƒÂ¢Ã¢â‚¬Å¡Ã‚Â¬ÃƒÂ¢Ã¢â‚¬Å¾Ã‚Â¢ÃƒÆ’Ã†â€™Ãƒâ€ Ã¢â‚¬â„¢ÃƒÆ’Ã¢â‚¬Å¡Ãƒâ€šÃ‚Â¢ÃƒÆ’Ã†â€™Ãƒâ€šÃ‚Â¢ÃƒÆ’Ã‚Â¢ÃƒÂ¢Ã¢â‚¬Å¡Ã‚Â¬Ãƒâ€¦Ã‚Â¡ÃƒÆ’Ã¢â‚¬Å¡Ãƒâ€šÃ‚Â¬ÃƒÆ’Ã†â€™ÃƒÂ¢Ã¢â€šÂ¬Ã…Â¡ÃƒÆ’Ã¢â‚¬Å¡Ãƒâ€šÃ‚Â ÃƒÆ’Ã†â€™Ãƒâ€ Ã¢â‚¬â„¢ÃƒÆ’Ã¢â‚¬Â ÃƒÂ¢Ã¢â€šÂ¬Ã¢â€žÂ¢ÃƒÆ’Ã†â€™ÃƒÂ¢Ã¢â€šÂ¬Ã…Â¡ÃƒÆ’Ã¢â‚¬Å¡Ãƒâ€šÃ‚Â¢ÃƒÆ’Ã†â€™Ãƒâ€ Ã¢â‚¬â„¢ÃƒÆ’Ã¢â‚¬Å¡Ãƒâ€šÃ‚Â¢ÃƒÆ’Ã†â€™Ãƒâ€šÃ‚Â¢ÃƒÆ’Ã‚Â¢ÃƒÂ¢Ã¢â€šÂ¬Ã…Â¡Ãƒâ€šÃ‚Â¬ÃƒÆ’Ã¢â‚¬Â¦Ãƒâ€šÃ‚Â¡ÃƒÆ’Ã†â€™ÃƒÂ¢Ã¢â€šÂ¬Ã…Â¡ÃƒÆ’Ã¢â‚¬Å¡Ãƒâ€šÃ‚Â¬ÃƒÆ’Ã†â€™Ãƒâ€ Ã¢â‚¬â„¢ÃƒÆ’Ã¢â‚¬Å¡Ãƒâ€šÃ‚Â¢ÃƒÆ’Ã†â€™Ãƒâ€šÃ‚Â¢ÃƒÆ’Ã‚Â¢ÃƒÂ¢Ã¢â€šÂ¬Ã…Â¡Ãƒâ€šÃ‚Â¬ÃƒÆ’Ã¢â‚¬Â¦Ãƒâ€šÃ‚Â¾ÃƒÆ’Ã†â€™ÃƒÂ¢Ã¢â€šÂ¬Ã…Â¡ÃƒÆ’Ã¢â‚¬Å¡Ãƒâ€šÃ‚Â¢ÃƒÆ’Ã†â€™Ãƒâ€ Ã¢â‚¬â„¢ÃƒÆ’Ã¢â‚¬Â ÃƒÂ¢Ã¢â€šÂ¬Ã¢â€žÂ¢ÃƒÆ’Ã†â€™ÃƒÂ¢Ã¢â€šÂ¬Ã‚Â ÃƒÆ’Ã‚Â¢ÃƒÂ¢Ã¢â‚¬Å¡Ã‚Â¬ÃƒÂ¢Ã¢â‚¬Å¾Ã‚Â¢ÃƒÆ’Ã†â€™Ãƒâ€ Ã¢â‚¬â„¢ÃƒÆ’Ã‚Â¢ÃƒÂ¢Ã¢â‚¬Å¡Ã‚Â¬Ãƒâ€šÃ‚Â ÃƒÆ’Ã†â€™Ãƒâ€šÃ‚Â¢ÃƒÆ’Ã‚Â¢ÃƒÂ¢Ã¢â€šÂ¬Ã…Â¡Ãƒâ€šÃ‚Â¬ÃƒÆ’Ã‚Â¢ÃƒÂ¢Ã¢â€šÂ¬Ã…Â¾Ãƒâ€šÃ‚Â¢ÃƒÆ’Ã†â€™Ãƒâ€ Ã¢â‚¬â„¢ÃƒÆ’Ã¢â‚¬Â ÃƒÂ¢Ã¢â€šÂ¬Ã¢â€žÂ¢ÃƒÆ’Ã†â€™ÃƒÂ¢Ã¢â€šÂ¬Ã…Â¡ÃƒÆ’Ã¢â‚¬Å¡Ãƒâ€šÃ‚Â¢ÃƒÆ’Ã†â€™Ãƒâ€ Ã¢â‚¬â„¢ÃƒÆ’Ã¢â‚¬Å¡Ãƒâ€šÃ‚Â¢ÃƒÆ’Ã†â€™Ãƒâ€šÃ‚Â¢ÃƒÆ’Ã‚Â¢ÃƒÂ¢Ã¢â€šÂ¬Ã…Â¡Ãƒâ€šÃ‚Â¬ÃƒÆ’Ã¢â‚¬Â¦Ãƒâ€šÃ‚Â¡ÃƒÆ’Ã†â€™ÃƒÂ¢Ã¢â€šÂ¬Ã…Â¡ÃƒÆ’Ã¢â‚¬Å¡Ãƒâ€šÃ‚Â¬ÃƒÆ’Ã†â€™Ãƒâ€ Ã¢â‚¬â„¢ÃƒÆ’Ã‚Â¢ÃƒÂ¢Ã¢â‚¬Å¡Ã‚Â¬Ãƒâ€šÃ‚Â¦ÃƒÆ’Ã†â€™ÃƒÂ¢Ã¢â€šÂ¬Ã…Â¡ÃƒÆ’Ã¢â‚¬Å¡Ãƒâ€šÃ‚Â¡ÃƒÆ’Ã†â€™Ãƒâ€ Ã¢â‚¬â„¢ÃƒÆ’Ã¢â‚¬Â ÃƒÂ¢Ã¢â€šÂ¬Ã¢â€žÂ¢ÃƒÆ’Ã†â€™ÃƒÂ¢Ã¢â€šÂ¬Ã‚Â ÃƒÆ’Ã‚Â¢ÃƒÂ¢Ã¢â‚¬Å¡Ã‚Â¬ÃƒÂ¢Ã¢â‚¬Å¾Ã‚Â¢ÃƒÆ’Ã†â€™Ãƒâ€ Ã¢â‚¬â„¢ÃƒÆ’Ã¢â‚¬Å¡Ãƒâ€šÃ‚Â¢ÃƒÆ’Ã†â€™Ãƒâ€šÃ‚Â¢ÃƒÆ’Ã‚Â¢ÃƒÂ¢Ã¢â‚¬Å¡Ã‚Â¬Ãƒâ€¦Ã‚Â¡ÃƒÆ’Ã¢â‚¬Å¡Ãƒâ€šÃ‚Â¬ÃƒÆ’Ã†â€™ÃƒÂ¢Ã¢â€šÂ¬Ã‚Â¦ÃƒÆ’Ã¢â‚¬Å¡Ãƒâ€šÃ‚Â¡ÃƒÆ’Ã†â€™Ãƒâ€ Ã¢â‚¬â„¢ÃƒÆ’Ã¢â‚¬Â ÃƒÂ¢Ã¢â€šÂ¬Ã¢â€žÂ¢ÃƒÆ’Ã†â€™Ãƒâ€šÃ‚Â¢ÃƒÆ’Ã‚Â¢ÃƒÂ¢Ã¢â€šÂ¬Ã…Â¡Ãƒâ€šÃ‚Â¬ÃƒÆ’Ã¢â‚¬Â¦Ãƒâ€šÃ‚Â¡ÃƒÆ’Ã†â€™Ãƒâ€ Ã¢â‚¬â„¢ÃƒÆ’Ã‚Â¢ÃƒÂ¢Ã¢â‚¬Å¡Ã‚Â¬Ãƒâ€¦Ã‚Â¡ÃƒÆ’Ã†â€™ÃƒÂ¢Ã¢â€šÂ¬Ã…Â¡ÃƒÆ’Ã¢â‚¬Å¡Ãƒâ€šÃ‚Â¢ÃƒÆ’Ã†â€™Ãƒâ€ Ã¢â‚¬â„¢ÃƒÆ’Ã¢â‚¬Â ÃƒÂ¢Ã¢â€šÂ¬Ã¢â€žÂ¢ÃƒÆ’Ã†â€™ÃƒÂ¢Ã¢â€šÂ¬Ã‚Â ÃƒÆ’Ã‚Â¢ÃƒÂ¢Ã¢â‚¬Å¡Ã‚Â¬ÃƒÂ¢Ã¢â‚¬Å¾Ã‚Â¢ÃƒÆ’Ã†â€™Ãƒâ€ Ã¢â‚¬â„¢ÃƒÆ’Ã‚Â¢ÃƒÂ¢Ã¢â‚¬Å¡Ã‚Â¬Ãƒâ€šÃ‚Â ÃƒÆ’Ã†â€™Ãƒâ€šÃ‚Â¢ÃƒÆ’Ã‚Â¢ÃƒÂ¢Ã¢â€šÂ¬Ã…Â¡Ãƒâ€šÃ‚Â¬ÃƒÆ’Ã‚Â¢ÃƒÂ¢Ã¢â€šÂ¬Ã…Â¾Ãƒâ€šÃ‚Â¢ÃƒÆ’Ã†â€™Ãƒâ€ Ã¢â‚¬â„¢ÃƒÆ’Ã¢â‚¬Â ÃƒÂ¢Ã¢â€šÂ¬Ã¢â€žÂ¢ÃƒÆ’Ã†â€™Ãƒâ€šÃ‚Â¢ÃƒÆ’Ã‚Â¢ÃƒÂ¢Ã¢â€šÂ¬Ã…Â¡Ãƒâ€šÃ‚Â¬ÃƒÆ’Ã¢â‚¬Å¡Ãƒâ€šÃ‚Â ÃƒÆ’Ã†â€™Ãƒâ€ Ã¢â‚¬â„¢ÃƒÆ’Ã¢â‚¬Å¡Ãƒâ€šÃ‚Â¢ÃƒÆ’Ã†â€™Ãƒâ€šÃ‚Â¢ÃƒÆ’Ã‚Â¢ÃƒÂ¢Ã¢â‚¬Å¡Ã‚Â¬Ãƒâ€¦Ã‚Â¡ÃƒÆ’Ã¢â‚¬Å¡Ãƒâ€šÃ‚Â¬ÃƒÆ’Ã†â€™Ãƒâ€šÃ‚Â¢ÃƒÆ’Ã‚Â¢ÃƒÂ¢Ã¢â‚¬Å¡Ã‚Â¬Ãƒâ€¦Ã‚Â¾ÃƒÆ’Ã¢â‚¬Å¡Ãƒâ€šÃ‚Â¢ÃƒÆ’Ã†â€™Ãƒâ€ Ã¢â‚¬â„¢ÃƒÆ’Ã¢â‚¬Â ÃƒÂ¢Ã¢â€šÂ¬Ã¢â€žÂ¢ÃƒÆ’Ã†â€™ÃƒÂ¢Ã¢â€šÂ¬Ã‚Â ÃƒÆ’Ã‚Â¢ÃƒÂ¢Ã¢â‚¬Å¡Ã‚Â¬ÃƒÂ¢Ã¢â‚¬Å¾Ã‚Â¢ÃƒÆ’Ã†â€™Ãƒâ€ Ã¢â‚¬â„¢ÃƒÆ’Ã¢â‚¬Å¡Ãƒâ€šÃ‚Â¢ÃƒÆ’Ã†â€™Ãƒâ€šÃ‚Â¢ÃƒÆ’Ã‚Â¢ÃƒÂ¢Ã¢â‚¬Å¡Ã‚Â¬Ãƒâ€¦Ã‚Â¡ÃƒÆ’Ã¢â‚¬Å¡Ãƒâ€šÃ‚Â¬ÃƒÆ’Ã†â€™ÃƒÂ¢Ã¢â€šÂ¬Ã‚Â¦ÃƒÆ’Ã¢â‚¬Å¡Ãƒâ€šÃ‚Â¡ÃƒÆ’Ã†â€™Ãƒâ€ Ã¢â‚¬â„¢ÃƒÆ’Ã¢â‚¬Â ÃƒÂ¢Ã¢â€šÂ¬Ã¢â€žÂ¢ÃƒÆ’Ã†â€™Ãƒâ€šÃ‚Â¢ÃƒÆ’Ã‚Â¢ÃƒÂ¢Ã¢â€šÂ¬Ã…Â¡Ãƒâ€šÃ‚Â¬ÃƒÆ’Ã¢â‚¬Â¦Ãƒâ€šÃ‚Â¡ÃƒÆ’Ã†â€™Ãƒâ€ Ã¢â‚¬â„¢ÃƒÆ’Ã‚Â¢ÃƒÂ¢Ã¢â‚¬Å¡Ã‚Â¬Ãƒâ€¦Ã‚Â¡ÃƒÆ’Ã†â€™ÃƒÂ¢Ã¢â€šÂ¬Ã…Â¡ÃƒÆ’Ã¢â‚¬Å¡Ãƒâ€šÃ‚Â¢ÃƒÆ’Ã†â€™Ãƒâ€ Ã¢â‚¬â„¢ÃƒÆ’Ã¢â‚¬Â ÃƒÂ¢Ã¢â€šÂ¬Ã¢â€žÂ¢ÃƒÆ’Ã†â€™ÃƒÂ¢Ã¢â€šÂ¬Ã‚Â ÃƒÆ’Ã‚Â¢ÃƒÂ¢Ã¢â‚¬Å¡Ã‚Â¬ÃƒÂ¢Ã¢â‚¬Å¾Ã‚Â¢ÃƒÆ’Ã†â€™Ãƒâ€ Ã¢â‚¬â„¢ÃƒÆ’Ã‚Â¢ÃƒÂ¢Ã¢â‚¬Å¡Ã‚Â¬Ãƒâ€šÃ‚Â ÃƒÆ’Ã†â€™Ãƒâ€šÃ‚Â¢ÃƒÆ’Ã‚Â¢ÃƒÂ¢Ã¢â€šÂ¬Ã…Â¡Ãƒâ€šÃ‚Â¬ÃƒÆ’Ã‚Â¢ÃƒÂ¢Ã¢â€šÂ¬Ã…Â¾Ãƒâ€šÃ‚Â¢ÃƒÆ’Ã†â€™Ãƒâ€ Ã¢â‚¬â„¢ÃƒÆ’Ã¢â‚¬Â ÃƒÂ¢Ã¢â€šÂ¬Ã¢â€žÂ¢ÃƒÆ’Ã†â€™Ãƒâ€šÃ‚Â¢ÃƒÆ’Ã‚Â¢ÃƒÂ¢Ã¢â€šÂ¬Ã…Â¡Ãƒâ€šÃ‚Â¬ÃƒÆ’Ã¢â‚¬Â¦Ãƒâ€šÃ‚Â¡ÃƒÆ’Ã†â€™Ãƒâ€ Ã¢â‚¬â„¢ÃƒÆ’Ã‚Â¢ÃƒÂ¢Ã¢â‚¬Å¡Ã‚Â¬Ãƒâ€¦Ã‚Â¡ÃƒÆ’Ã†â€™ÃƒÂ¢Ã¢â€šÂ¬Ã…Â¡ÃƒÆ’Ã¢â‚¬Å¡Ãƒâ€šÃ‚Â¢ÃƒÆ’Ã†â€™Ãƒâ€ Ã¢â‚¬â„¢ÃƒÆ’Ã¢â‚¬Â ÃƒÂ¢Ã¢â€šÂ¬Ã¢â€žÂ¢ÃƒÆ’Ã†â€™ÃƒÂ¢Ã¢â€šÂ¬Ã‚Â ÃƒÆ’Ã‚Â¢ÃƒÂ¢Ã¢â‚¬Å¡Ã‚Â¬ÃƒÂ¢Ã¢â‚¬Å¾Ã‚Â¢ÃƒÆ’Ã†â€™Ãƒâ€ Ã¢â‚¬â„¢ÃƒÆ’Ã‚Â¢ÃƒÂ¢Ã¢â‚¬Å¡Ã‚Â¬Ãƒâ€¦Ã‚Â¡ÃƒÆ’Ã†â€™ÃƒÂ¢Ã¢â€šÂ¬Ã…Â¡ÃƒÆ’Ã¢â‚¬Å¡Ãƒâ€šÃ‚Â¢ÃƒÆ’Ã†â€™Ãƒâ€ Ã¢â‚¬â„¢ÃƒÆ’Ã¢â‚¬Â ÃƒÂ¢Ã¢â€šÂ¬Ã¢â€žÂ¢ÃƒÆ’Ã†â€™ÃƒÂ¢Ã¢â€šÂ¬Ã…Â¡ÃƒÆ’Ã¢â‚¬Å¡Ãƒâ€šÃ‚Â¢ÃƒÆ’Ã†â€™Ãƒâ€ Ã¢â‚¬â„¢ÃƒÆ’Ã¢â‚¬Å¡Ãƒâ€šÃ‚Â¢ÃƒÆ’Ã†â€™Ãƒâ€šÃ‚Â¢ÃƒÆ’Ã‚Â¢ÃƒÂ¢Ã¢â‚¬Å¡Ã‚Â¬Ãƒâ€¦Ã‚Â¡ÃƒÆ’Ã¢â‚¬Å¡Ãƒâ€šÃ‚Â¬ÃƒÆ’Ã†â€™ÃƒÂ¢Ã¢â€šÂ¬Ã‚Â¦ÃƒÆ’Ã¢â‚¬Å¡Ãƒâ€šÃ‚Â¡ÃƒÆ’Ã†â€™Ãƒâ€ Ã¢â‚¬â„¢ÃƒÆ’Ã‚Â¢ÃƒÂ¢Ã¢â‚¬Å¡Ã‚Â¬Ãƒâ€¦Ã‚Â¡ÃƒÆ’Ã†â€™ÃƒÂ¢Ã¢â€šÂ¬Ã…Â¡ÃƒÆ’Ã¢â‚¬Å¡Ãƒâ€šÃ‚Â¬ÃƒÆ’Ã†â€™Ãƒâ€ Ã¢â‚¬â„¢ÃƒÆ’Ã¢â‚¬Â ÃƒÂ¢Ã¢â€šÂ¬Ã¢â€žÂ¢ÃƒÆ’Ã†â€™Ãƒâ€šÃ‚Â¢ÃƒÆ’Ã‚Â¢ÃƒÂ¢Ã¢â€šÂ¬Ã…Â¡Ãƒâ€šÃ‚Â¬ÃƒÆ’Ã¢â‚¬Å¡Ãƒâ€šÃ‚Â¦ÃƒÆ’Ã†â€™Ãƒâ€ Ã¢â‚¬â„¢ÃƒÆ’Ã‚Â¢ÃƒÂ¢Ã¢â‚¬Å¡Ã‚Â¬Ãƒâ€¦Ã‚Â¡ÃƒÆ’Ã†â€™ÃƒÂ¢Ã¢â€šÂ¬Ã…Â¡ÃƒÆ’Ã¢â‚¬Å¡Ãƒâ€šÃ‚Â¡ÃƒÆ’Ã†â€™Ãƒâ€ Ã¢â‚¬â„¢ÃƒÆ’Ã¢â‚¬Â ÃƒÂ¢Ã¢â€šÂ¬Ã¢â€žÂ¢ÃƒÆ’Ã†â€™ÃƒÂ¢Ã¢â€šÂ¬Ã‚Â ÃƒÆ’Ã‚Â¢ÃƒÂ¢Ã¢â‚¬Å¡Ã‚Â¬ÃƒÂ¢Ã¢â‚¬Å¾Ã‚Â¢ÃƒÆ’Ã†â€™Ãƒâ€ Ã¢â‚¬â„¢ÃƒÆ’Ã¢â‚¬Å¡Ãƒâ€šÃ‚Â¢ÃƒÆ’Ã†â€™Ãƒâ€šÃ‚Â¢ÃƒÆ’Ã‚Â¢ÃƒÂ¢Ã¢â‚¬Å¡Ã‚Â¬Ãƒâ€¦Ã‚Â¡ÃƒÆ’Ã¢â‚¬Å¡Ãƒâ€šÃ‚Â¬ÃƒÆ’Ã†â€™ÃƒÂ¢Ã¢â€šÂ¬Ã‚Â¦ÃƒÆ’Ã¢â‚¬Å¡Ãƒâ€šÃ‚Â¡ÃƒÆ’Ã†â€™Ãƒâ€ Ã¢â‚¬â„¢ÃƒÆ’Ã¢â‚¬Â ÃƒÂ¢Ã¢â€šÂ¬Ã¢â€žÂ¢ÃƒÆ’Ã†â€™Ãƒâ€šÃ‚Â¢ÃƒÆ’Ã‚Â¢ÃƒÂ¢Ã¢â€šÂ¬Ã…Â¡Ãƒâ€šÃ‚Â¬ÃƒÆ’Ã¢â‚¬Â¦Ãƒâ€šÃ‚Â¡ÃƒÆ’Ã†â€™Ãƒâ€ Ã¢â‚¬â„¢ÃƒÆ’Ã‚Â¢ÃƒÂ¢Ã¢â‚¬Å¡Ã‚Â¬Ãƒâ€¦Ã‚Â¡ÃƒÆ’Ã†â€™ÃƒÂ¢Ã¢â€šÂ¬Ã…Â¡ÃƒÆ’Ã¢â‚¬Å¡Ãƒâ€šÃ‚Â¬ÃƒÆ’Ã†â€™Ãƒâ€ Ã¢â‚¬â„¢ÃƒÆ’Ã¢â‚¬Â ÃƒÂ¢Ã¢â€šÂ¬Ã¢â€žÂ¢ÃƒÆ’Ã†â€™ÃƒÂ¢Ã¢â€šÂ¬Ã‚Â ÃƒÆ’Ã‚Â¢ÃƒÂ¢Ã¢â‚¬Å¡Ã‚Â¬ÃƒÂ¢Ã¢â‚¬Å¾Ã‚Â¢ÃƒÆ’Ã†â€™Ãƒâ€ Ã¢â‚¬â„¢ÃƒÆ’Ã‚Â¢ÃƒÂ¢Ã¢â‚¬Å¡Ã‚Â¬Ãƒâ€šÃ‚Â ÃƒÆ’Ã†â€™Ãƒâ€šÃ‚Â¢ÃƒÆ’Ã‚Â¢ÃƒÂ¢Ã¢â€šÂ¬Ã…Â¡Ãƒâ€šÃ‚Â¬ÃƒÆ’Ã‚Â¢ÃƒÂ¢Ã¢â€šÂ¬Ã…Â¾Ãƒâ€šÃ‚Â¢ÃƒÆ’Ã†â€™Ãƒâ€ Ã¢â‚¬â„¢ÃƒÆ’Ã¢â‚¬Â ÃƒÂ¢Ã¢â€šÂ¬Ã¢â€žÂ¢ÃƒÆ’Ã†â€™ÃƒÂ¢Ã¢â€šÂ¬Ã…Â¡ÃƒÆ’Ã¢â‚¬Å¡Ãƒâ€šÃ‚Â¢ÃƒÆ’Ã†â€™Ãƒâ€ Ã¢â‚¬â„¢ÃƒÆ’Ã¢â‚¬Å¡Ãƒâ€šÃ‚Â¢ÃƒÆ’Ã†â€™Ãƒâ€šÃ‚Â¢ÃƒÆ’Ã‚Â¢ÃƒÂ¢Ã¢â€šÂ¬Ã…Â¡Ãƒâ€šÃ‚Â¬ÃƒÆ’Ã¢â‚¬Â¦Ãƒâ€šÃ‚Â¡ÃƒÆ’Ã†â€™ÃƒÂ¢Ã¢â€šÂ¬Ã…Â¡ÃƒÆ’Ã¢â‚¬Å¡Ãƒâ€šÃ‚Â¬ÃƒÆ’Ã†â€™Ãƒâ€ Ã¢â‚¬â„¢ÃƒÆ’Ã‚Â¢ÃƒÂ¢Ã¢â‚¬Å¡Ã‚Â¬Ãƒâ€¦Ã‚Â¡ÃƒÆ’Ã†â€™ÃƒÂ¢Ã¢â€šÂ¬Ã…Â¡ÃƒÆ’Ã¢â‚¬Å¡Ãƒâ€šÃ‚Â¦ÃƒÆ’Ã†â€™Ãƒâ€ Ã¢â‚¬â„¢ÃƒÆ’Ã¢â‚¬Â ÃƒÂ¢Ã¢â€šÂ¬Ã¢â€žÂ¢ÃƒÆ’Ã†â€™ÃƒÂ¢Ã¢â€šÂ¬Ã‚Â ÃƒÆ’Ã‚Â¢ÃƒÂ¢Ã¢â‚¬Å¡Ã‚Â¬ÃƒÂ¢Ã¢â‚¬Å¾Ã‚Â¢ÃƒÆ’Ã†â€™Ãƒâ€ Ã¢â‚¬â„¢ÃƒÆ’Ã¢â‚¬Å¡Ãƒâ€šÃ‚Â¢ÃƒÆ’Ã†â€™Ãƒâ€šÃ‚Â¢ÃƒÆ’Ã‚Â¢ÃƒÂ¢Ã¢â‚¬Å¡Ã‚Â¬Ãƒâ€¦Ã‚Â¡ÃƒÆ’Ã¢â‚¬Å¡Ãƒâ€šÃ‚Â¬ÃƒÆ’Ã†â€™ÃƒÂ¢Ã¢â€šÂ¬Ã‚Â¦ÃƒÆ’Ã¢â‚¬Å¡Ãƒâ€šÃ‚Â¡ÃƒÆ’Ã†â€™Ãƒâ€ Ã¢â‚¬â„¢ÃƒÆ’Ã¢â‚¬Â ÃƒÂ¢Ã¢â€šÂ¬Ã¢â€žÂ¢ÃƒÆ’Ã†â€™Ãƒâ€šÃ‚Â¢ÃƒÆ’Ã‚Â¢ÃƒÂ¢Ã¢â€šÂ¬Ã…Â¡Ãƒâ€šÃ‚Â¬ÃƒÆ’Ã¢â‚¬Â¦Ãƒâ€šÃ‚Â¡ÃƒÆ’Ã†â€™Ãƒâ€ Ã¢â‚¬â„¢ÃƒÆ’Ã‚Â¢ÃƒÂ¢Ã¢â‚¬Å¡Ã‚Â¬Ãƒâ€¦Ã‚Â¡ÃƒÆ’Ã†â€™ÃƒÂ¢Ã¢â€šÂ¬Ã…Â¡ÃƒÆ’Ã¢â‚¬Å¡Ãƒâ€šÃ‚Â¡ÃƒÆ’Ã†â€™Ãƒâ€ Ã¢â‚¬â„¢ÃƒÆ’Ã¢â‚¬Â ÃƒÂ¢Ã¢â€šÂ¬Ã¢â€žÂ¢ÃƒÆ’Ã†â€™ÃƒÂ¢Ã¢â€šÂ¬Ã‚Â ÃƒÆ’Ã‚Â¢ÃƒÂ¢Ã¢â‚¬Å¡Ã‚Â¬ÃƒÂ¢Ã¢â‚¬Å¾Ã‚Â¢ÃƒÆ’Ã†â€™Ãƒâ€ Ã¢â‚¬â„¢ÃƒÆ’Ã‚Â¢ÃƒÂ¢Ã¢â‚¬Å¡Ã‚Â¬Ãƒâ€šÃ‚Â ÃƒÆ’Ã†â€™Ãƒâ€šÃ‚Â¢ÃƒÆ’Ã‚Â¢ÃƒÂ¢Ã¢â€šÂ¬Ã…Â¡Ãƒâ€šÃ‚Â¬ÃƒÆ’Ã‚Â¢ÃƒÂ¢Ã¢â€šÂ¬Ã…Â¾Ãƒâ€šÃ‚Â¢ÃƒÆ’Ã†â€™Ãƒâ€ Ã¢â‚¬â„¢ÃƒÆ’Ã¢â‚¬Â ÃƒÂ¢Ã¢â€šÂ¬Ã¢â€žÂ¢ÃƒÆ’Ã†â€™Ãƒâ€šÃ‚Â¢ÃƒÆ’Ã‚Â¢ÃƒÂ¢Ã¢â€šÂ¬Ã…Â¡Ãƒâ€šÃ‚Â¬ÃƒÆ’Ã¢â‚¬Å¡Ãƒâ€šÃ‚Â ÃƒÆ’Ã†â€™Ãƒâ€ Ã¢â‚¬â„¢ÃƒÆ’Ã¢â‚¬Å¡Ãƒâ€šÃ‚Â¢ÃƒÆ’Ã†â€™Ãƒâ€šÃ‚Â¢ÃƒÆ’Ã‚Â¢ÃƒÂ¢Ã¢â‚¬Å¡Ã‚Â¬Ãƒâ€¦Ã‚Â¡ÃƒÆ’Ã¢â‚¬Å¡Ãƒâ€šÃ‚Â¬ÃƒÆ’Ã†â€™Ãƒâ€šÃ‚Â¢ÃƒÆ’Ã‚Â¢ÃƒÂ¢Ã¢â‚¬Å¡Ã‚Â¬Ãƒâ€¦Ã‚Â¾ÃƒÆ’Ã¢â‚¬Å¡Ãƒâ€šÃ‚Â¢ÃƒÆ’Ã†â€™Ãƒâ€ Ã¢â‚¬â„¢ÃƒÆ’Ã¢â‚¬Â ÃƒÂ¢Ã¢â€šÂ¬Ã¢â€žÂ¢ÃƒÆ’Ã†â€™ÃƒÂ¢Ã¢â€šÂ¬Ã‚Â ÃƒÆ’Ã‚Â¢ÃƒÂ¢Ã¢â‚¬Å¡Ã‚Â¬ÃƒÂ¢Ã¢â‚¬Å¾Ã‚Â¢ÃƒÆ’Ã†â€™Ãƒâ€ Ã¢â‚¬â„¢ÃƒÆ’Ã¢â‚¬Å¡Ãƒâ€šÃ‚Â¢ÃƒÆ’Ã†â€™Ãƒâ€šÃ‚Â¢ÃƒÆ’Ã‚Â¢ÃƒÂ¢Ã¢â‚¬Å¡Ã‚Â¬Ãƒâ€¦Ã‚Â¡ÃƒÆ’Ã¢â‚¬Å¡Ãƒâ€šÃ‚Â¬ÃƒÆ’Ã†â€™ÃƒÂ¢Ã¢â€šÂ¬Ã‚Â¦ÃƒÆ’Ã¢â‚¬Å¡Ãƒâ€šÃ‚Â¡ÃƒÆ’Ã†â€™Ãƒâ€ Ã¢â‚¬â„¢ÃƒÆ’Ã¢â‚¬Â ÃƒÂ¢Ã¢â€šÂ¬Ã¢â€žÂ¢ÃƒÆ’Ã†â€™Ãƒâ€šÃ‚Â¢ÃƒÆ’Ã‚Â¢ÃƒÂ¢Ã¢â€šÂ¬Ã…Â¡Ãƒâ€šÃ‚Â¬ÃƒÆ’Ã¢â‚¬Â¦Ãƒâ€šÃ‚Â¡ÃƒÆ’Ã†â€™Ãƒâ€ Ã¢â‚¬â„¢ÃƒÆ’Ã‚Â¢ÃƒÂ¢Ã¢â‚¬Å¡Ã‚Â¬Ãƒâ€¦Ã‚Â¡ÃƒÆ’Ã†â€™ÃƒÂ¢Ã¢â€šÂ¬Ã…Â¡ÃƒÆ’Ã¢â‚¬Å¡Ãƒâ€šÃ‚Â¢ÃƒÆ’Ã†â€™Ãƒâ€ Ã¢â‚¬â„¢ÃƒÆ’Ã¢â‚¬Â ÃƒÂ¢Ã¢â€šÂ¬Ã¢â€žÂ¢ÃƒÆ’Ã†â€™ÃƒÂ¢Ã¢â€šÂ¬Ã‚Â ÃƒÆ’Ã‚Â¢ÃƒÂ¢Ã¢â‚¬Å¡Ã‚Â¬ÃƒÂ¢Ã¢â‚¬Å¾Ã‚Â¢ÃƒÆ’Ã†â€™Ãƒâ€ Ã¢â‚¬â„¢ÃƒÆ’Ã‚Â¢ÃƒÂ¢Ã¢â‚¬Å¡Ã‚Â¬Ãƒâ€šÃ‚Â ÃƒÆ’Ã†â€™Ãƒâ€šÃ‚Â¢ÃƒÆ’Ã‚Â¢ÃƒÂ¢Ã¢â€šÂ¬Ã…Â¡Ãƒâ€šÃ‚Â¬ÃƒÆ’Ã‚Â¢ÃƒÂ¢Ã¢â€šÂ¬Ã…Â¾Ãƒâ€šÃ‚Â¢ÃƒÆ’Ã†â€™Ãƒâ€ Ã¢â‚¬â„¢ÃƒÆ’Ã¢â‚¬Â ÃƒÂ¢Ã¢â€šÂ¬Ã¢â€žÂ¢ÃƒÆ’Ã†â€™Ãƒâ€šÃ‚Â¢ÃƒÆ’Ã‚Â¢ÃƒÂ¢Ã¢â€šÂ¬Ã…Â¡Ãƒâ€šÃ‚Â¬ÃƒÆ’Ã¢â‚¬Â¦Ãƒâ€šÃ‚Â¡ÃƒÆ’Ã†â€™Ãƒâ€ Ã¢â‚¬â„¢ÃƒÆ’Ã‚Â¢ÃƒÂ¢Ã¢â‚¬Å¡Ã‚Â¬Ãƒâ€¦Ã‚Â¡ÃƒÆ’Ã†â€™ÃƒÂ¢Ã¢â€šÂ¬Ã…Â¡ÃƒÆ’Ã¢â‚¬Å¡Ãƒâ€šÃ‚Â¢ÃƒÆ’Ã†â€™Ãƒâ€ Ã¢â‚¬â„¢ÃƒÆ’Ã¢â‚¬Â ÃƒÂ¢Ã¢â€šÂ¬Ã¢â€žÂ¢ÃƒÆ’Ã†â€™ÃƒÂ¢Ã¢â€šÂ¬Ã‚Â ÃƒÆ’Ã‚Â¢ÃƒÂ¢Ã¢â‚¬Å¡Ã‚Â¬ÃƒÂ¢Ã¢â‚¬Å¾Ã‚Â¢ÃƒÆ’Ã†â€™Ãƒâ€ Ã¢â‚¬â„¢ÃƒÆ’Ã‚Â¢ÃƒÂ¢Ã¢â‚¬Å¡Ã‚Â¬Ãƒâ€¦Ã‚Â¡ÃƒÆ’Ã†â€™ÃƒÂ¢Ã¢â€šÂ¬Ã…Â¡ÃƒÆ’Ã¢â‚¬Å¡Ãƒâ€šÃ‚Â¢ÃƒÆ’Ã†â€™Ãƒâ€ Ã¢â‚¬â„¢ÃƒÆ’Ã¢â‚¬Â ÃƒÂ¢Ã¢â€šÂ¬Ã¢â€žÂ¢ÃƒÆ’Ã†â€™ÃƒÂ¢Ã¢â€šÂ¬Ã…Â¡ÃƒÆ’Ã¢â‚¬Å¡Ãƒâ€šÃ‚Â¢ÃƒÆ’Ã†â€™Ãƒâ€ Ã¢â‚¬â„¢ÃƒÆ’Ã¢â‚¬Å¡Ãƒâ€šÃ‚Â¢ÃƒÆ’Ã†â€™Ãƒâ€šÃ‚Â¢ÃƒÆ’Ã‚Â¢ÃƒÂ¢Ã¢â‚¬Å¡Ã‚Â¬Ãƒâ€¦Ã‚Â¡ÃƒÆ’Ã¢â‚¬Å¡Ãƒâ€šÃ‚Â¬ÃƒÆ’Ã†â€™ÃƒÂ¢Ã¢â€šÂ¬Ã‚Â¦ÃƒÆ’Ã¢â‚¬Å¡Ãƒâ€šÃ‚Â¡ÃƒÆ’Ã†â€™Ãƒâ€ Ã¢â‚¬â„¢ÃƒÆ’Ã‚Â¢ÃƒÂ¢Ã¢â‚¬Å¡Ã‚Â¬Ãƒâ€¦Ã‚Â¡ÃƒÆ’Ã†â€™ÃƒÂ¢Ã¢â€šÂ¬Ã…Â¡ÃƒÆ’Ã¢â‚¬Å¡Ãƒâ€šÃ‚Â¬ÃƒÆ’Ã†â€™Ãƒâ€ Ã¢â‚¬â„¢ÃƒÆ’Ã¢â‚¬Â ÃƒÂ¢Ã¢â€šÂ¬Ã¢â€žÂ¢ÃƒÆ’Ã†â€™Ãƒâ€šÃ‚Â¢ÃƒÆ’Ã‚Â¢ÃƒÂ¢Ã¢â€šÂ¬Ã…Â¡Ãƒâ€šÃ‚Â¬ÃƒÆ’Ã¢â‚¬Å¡Ãƒâ€šÃ‚Â¦ÃƒÆ’Ã†â€™Ãƒâ€ Ã¢â‚¬â„¢ÃƒÆ’Ã‚Â¢ÃƒÂ¢Ã¢â‚¬Å¡Ã‚Â¬Ãƒâ€¦Ã‚Â¡ÃƒÆ’Ã†â€™ÃƒÂ¢Ã¢â€šÂ¬Ã…Â¡ÃƒÆ’Ã¢â‚¬Å¡Ãƒâ€šÃ‚Â¡ÃƒÆ’Ã†â€™Ãƒâ€ Ã¢â‚¬â„¢ÃƒÆ’Ã¢â‚¬Â ÃƒÂ¢Ã¢â€šÂ¬Ã¢â€žÂ¢ÃƒÆ’Ã†â€™ÃƒÂ¢Ã¢â€šÂ¬Ã‚Â ÃƒÆ’Ã‚Â¢ÃƒÂ¢Ã¢â‚¬Å¡Ã‚Â¬ÃƒÂ¢Ã¢â‚¬Å¾Ã‚Â¢ÃƒÆ’Ã†â€™Ãƒâ€ Ã¢â‚¬â„¢ÃƒÆ’Ã¢â‚¬Å¡Ãƒâ€šÃ‚Â¢ÃƒÆ’Ã†â€™Ãƒâ€šÃ‚Â¢ÃƒÆ’Ã‚Â¢ÃƒÂ¢Ã¢â‚¬Å¡Ã‚Â¬Ãƒâ€¦Ã‚Â¡ÃƒÆ’Ã¢â‚¬Å¡Ãƒâ€šÃ‚Â¬ÃƒÆ’Ã†â€™ÃƒÂ¢Ã¢â€šÂ¬Ã‚Â¦ÃƒÆ’Ã¢â‚¬Å¡Ãƒâ€šÃ‚Â¡ÃƒÆ’Ã†â€™Ãƒâ€ Ã¢â‚¬â„¢ÃƒÆ’Ã¢â‚¬Â ÃƒÂ¢Ã¢â€šÂ¬Ã¢â€žÂ¢ÃƒÆ’Ã†â€™Ãƒâ€šÃ‚Â¢ÃƒÆ’Ã‚Â¢ÃƒÂ¢Ã¢â€šÂ¬Ã…Â¡Ãƒâ€šÃ‚Â¬ÃƒÆ’Ã¢â‚¬Â¦Ãƒâ€šÃ‚Â¡ÃƒÆ’Ã†â€™Ãƒâ€ Ã¢â‚¬â„¢ÃƒÆ’Ã‚Â¢ÃƒÂ¢Ã¢â‚¬Å¡Ã‚Â¬Ãƒâ€¦Ã‚Â¡ÃƒÆ’Ã†â€™ÃƒÂ¢Ã¢â€šÂ¬Ã…Â¡ÃƒÆ’Ã¢â‚¬Å¡Ãƒâ€šÃ‚Â¬ÃƒÆ’Ã†â€™Ãƒâ€ Ã¢â‚¬â„¢ÃƒÆ’Ã¢â‚¬Â ÃƒÂ¢Ã¢â€šÂ¬Ã¢â€žÂ¢ÃƒÆ’Ã†â€™ÃƒÂ¢Ã¢â€šÂ¬Ã‚Â ÃƒÆ’Ã‚Â¢ÃƒÂ¢Ã¢â‚¬Å¡Ã‚Â¬ÃƒÂ¢Ã¢â‚¬Å¾Ã‚Â¢ÃƒÆ’Ã†â€™Ãƒâ€ Ã¢â‚¬â„¢ÃƒÆ’Ã‚Â¢ÃƒÂ¢Ã¢â‚¬Å¡Ã‚Â¬Ãƒâ€šÃ‚Â ÃƒÆ’Ã†â€™Ãƒâ€šÃ‚Â¢ÃƒÆ’Ã‚Â¢ÃƒÂ¢Ã¢â€šÂ¬Ã…Â¡Ãƒâ€šÃ‚Â¬ÃƒÆ’Ã‚Â¢ÃƒÂ¢Ã¢â€šÂ¬Ã…Â¾Ãƒâ€šÃ‚Â¢ÃƒÆ’Ã†â€™Ãƒâ€ Ã¢â‚¬â„¢ÃƒÆ’Ã¢â‚¬Â ÃƒÂ¢Ã¢â€šÂ¬Ã¢â€žÂ¢ÃƒÆ’Ã†â€™ÃƒÂ¢Ã¢â€šÂ¬Ã…Â¡ÃƒÆ’Ã¢â‚¬Å¡Ãƒâ€šÃ‚Â¢ÃƒÆ’Ã†â€™Ãƒâ€ Ã¢â‚¬â„¢ÃƒÆ’Ã¢â‚¬Å¡Ãƒâ€šÃ‚Â¢ÃƒÆ’Ã†â€™Ãƒâ€šÃ‚Â¢ÃƒÆ’Ã‚Â¢ÃƒÂ¢Ã¢â€šÂ¬Ã…Â¡Ãƒâ€šÃ‚Â¬ÃƒÆ’Ã¢â‚¬Â¦Ãƒâ€šÃ‚Â¡ÃƒÆ’Ã†â€™ÃƒÂ¢Ã¢â€šÂ¬Ã…Â¡ÃƒÆ’Ã¢â‚¬Å¡Ãƒâ€šÃ‚Â¬ÃƒÆ’Ã†â€™Ãƒâ€ Ã¢â‚¬â„¢ÃƒÆ’Ã‚Â¢ÃƒÂ¢Ã¢â‚¬Å¡Ã‚Â¬Ãƒâ€¦Ã‚Â¡ÃƒÆ’Ã†â€™ÃƒÂ¢Ã¢â€šÂ¬Ã…Â¡ÃƒÆ’Ã¢â‚¬Å¡Ãƒâ€šÃ‚Â¦ÃƒÆ’Ã†â€™Ãƒâ€ Ã¢â‚¬â„¢ÃƒÆ’Ã¢â‚¬Â ÃƒÂ¢Ã¢â€šÂ¬Ã¢â€žÂ¢ÃƒÆ’Ã†â€™ÃƒÂ¢Ã¢â€šÂ¬Ã‚Â ÃƒÆ’Ã‚Â¢ÃƒÂ¢Ã¢â‚¬Å¡Ã‚Â¬ÃƒÂ¢Ã¢â‚¬Å¾Ã‚Â¢ÃƒÆ’Ã†â€™Ãƒâ€ Ã¢â‚¬â„¢ÃƒÆ’Ã¢â‚¬Å¡Ãƒâ€šÃ‚Â¢ÃƒÆ’Ã†â€™Ãƒâ€šÃ‚Â¢ÃƒÆ’Ã‚Â¢ÃƒÂ¢Ã¢â‚¬Å¡Ã‚Â¬Ãƒâ€¦Ã‚Â¡ÃƒÆ’Ã¢â‚¬Å¡Ãƒâ€šÃ‚Â¬ÃƒÆ’Ã†â€™ÃƒÂ¢Ã¢â€šÂ¬Ã‚Â¦ÃƒÆ’Ã¢â‚¬Å¡Ãƒâ€šÃ‚Â¡ÃƒÆ’Ã†â€™Ãƒâ€ Ã¢â‚¬â„¢ÃƒÆ’Ã¢â‚¬Â ÃƒÂ¢Ã¢â€šÂ¬Ã¢â€žÂ¢ÃƒÆ’Ã†â€™Ãƒâ€šÃ‚Â¢ÃƒÆ’Ã‚Â¢ÃƒÂ¢Ã¢â€šÂ¬Ã…Â¡Ãƒâ€šÃ‚Â¬ÃƒÆ’Ã¢â‚¬Â¦Ãƒâ€šÃ‚Â¡ÃƒÆ’Ã†â€™Ãƒâ€ Ã¢â‚¬â„¢ÃƒÆ’Ã‚Â¢ÃƒÂ¢Ã¢â‚¬Å¡Ã‚Â¬Ãƒâ€¦Ã‚Â¡ÃƒÆ’Ã†â€™ÃƒÂ¢Ã¢â€šÂ¬Ã…Â¡ÃƒÆ’Ã¢â‚¬Å¡Ãƒâ€šÃ‚Â¾ÃƒÆ’Ã†â€™Ãƒâ€ Ã¢â‚¬â„¢ÃƒÆ’Ã¢â‚¬Â ÃƒÂ¢Ã¢â€šÂ¬Ã¢â€žÂ¢ÃƒÆ’Ã†â€™ÃƒÂ¢Ã¢â€šÂ¬Ã‚Â ÃƒÆ’Ã‚Â¢ÃƒÂ¢Ã¢â‚¬Å¡Ã‚Â¬ÃƒÂ¢Ã¢â‚¬Å¾Ã‚Â¢ÃƒÆ’Ã†â€™Ãƒâ€ Ã¢â‚¬â„¢ÃƒÆ’Ã‚Â¢ÃƒÂ¢Ã¢â‚¬Å¡Ã‚Â¬Ãƒâ€šÃ‚Â ÃƒÆ’Ã†â€™Ãƒâ€šÃ‚Â¢ÃƒÆ’Ã‚Â¢ÃƒÂ¢Ã¢â€šÂ¬Ã…Â¡Ãƒâ€šÃ‚Â¬ÃƒÆ’Ã‚Â¢ÃƒÂ¢Ã¢â€šÂ¬Ã…Â¾Ãƒâ€šÃ‚Â¢ÃƒÆ’Ã†â€™Ãƒâ€ Ã¢â‚¬â„¢ÃƒÆ’Ã¢â‚¬Â ÃƒÂ¢Ã¢â€šÂ¬Ã¢â€žÂ¢ÃƒÆ’Ã†â€™Ãƒâ€šÃ‚Â¢ÃƒÆ’Ã‚Â¢ÃƒÂ¢Ã¢â€šÂ¬Ã…Â¡Ãƒâ€šÃ‚Â¬ÃƒÆ’Ã¢â‚¬Å¡Ãƒâ€šÃ‚Â ÃƒÆ’Ã†â€™Ãƒâ€ Ã¢â‚¬â„¢ÃƒÆ’Ã¢â‚¬Å¡Ãƒâ€šÃ‚Â¢ÃƒÆ’Ã†â€™Ãƒâ€šÃ‚Â¢ÃƒÆ’Ã‚Â¢ÃƒÂ¢Ã¢â‚¬Å¡Ã‚Â¬Ãƒâ€¦Ã‚Â¡ÃƒÆ’Ã¢â‚¬Å¡Ãƒâ€šÃ‚Â¬ÃƒÆ’Ã†â€™Ãƒâ€šÃ‚Â¢ÃƒÆ’Ã‚Â¢ÃƒÂ¢Ã¢â‚¬Å¡Ã‚Â¬Ãƒâ€¦Ã‚Â¾ÃƒÆ’Ã¢â‚¬Å¡Ãƒâ€šÃ‚Â¢ÃƒÆ’Ã†â€™Ãƒâ€ Ã¢â‚¬â„¢ÃƒÆ’Ã¢â‚¬Â ÃƒÂ¢Ã¢â€šÂ¬Ã¢â€žÂ¢ÃƒÆ’Ã†â€™ÃƒÂ¢Ã¢â€šÂ¬Ã‚Â ÃƒÆ’Ã‚Â¢ÃƒÂ¢Ã¢â‚¬Å¡Ã‚Â¬ÃƒÂ¢Ã¢â‚¬Å¾Ã‚Â¢ÃƒÆ’Ã†â€™Ãƒâ€ Ã¢â‚¬â„¢ÃƒÆ’Ã¢â‚¬Å¡Ãƒâ€šÃ‚Â¢ÃƒÆ’Ã†â€™Ãƒâ€šÃ‚Â¢ÃƒÆ’Ã‚Â¢ÃƒÂ¢Ã¢â‚¬Å¡Ã‚Â¬Ãƒâ€¦Ã‚Â¡ÃƒÆ’Ã¢â‚¬Å¡Ãƒâ€šÃ‚Â¬ÃƒÆ’Ã†â€™ÃƒÂ¢Ã¢â€šÂ¬Ã…Â¡ÃƒÆ’Ã¢â‚¬Å¡Ãƒâ€šÃ‚Â ÃƒÆ’Ã†â€™Ãƒâ€ Ã¢â‚¬â„¢ÃƒÆ’Ã¢â‚¬Â ÃƒÂ¢Ã¢â€šÂ¬Ã¢â€žÂ¢ÃƒÆ’Ã†â€™ÃƒÂ¢Ã¢â€šÂ¬Ã…Â¡ÃƒÆ’Ã¢â‚¬Å¡Ãƒâ€šÃ‚Â¢ÃƒÆ’Ã†â€™Ãƒâ€ Ã¢â‚¬â„¢ÃƒÆ’Ã¢â‚¬Å¡Ãƒâ€šÃ‚Â¢ÃƒÆ’Ã†â€™Ãƒâ€šÃ‚Â¢ÃƒÆ’Ã‚Â¢ÃƒÂ¢Ã¢â€šÂ¬Ã…Â¡Ãƒâ€šÃ‚Â¬ÃƒÆ’Ã¢â‚¬Â¦Ãƒâ€šÃ‚Â¡ÃƒÆ’Ã†â€™ÃƒÂ¢Ã¢â€šÂ¬Ã…Â¡ÃƒÆ’Ã¢â‚¬Å¡Ãƒâ€šÃ‚Â¬ÃƒÆ’Ã†â€™Ãƒâ€ Ã¢â‚¬â„¢ÃƒÆ’Ã¢â‚¬Å¡Ãƒâ€šÃ‚Â¢ÃƒÆ’Ã†â€™Ãƒâ€šÃ‚Â¢ÃƒÆ’Ã‚Â¢ÃƒÂ¢Ã¢â€šÂ¬Ã…Â¡Ãƒâ€šÃ‚Â¬ÃƒÆ’Ã¢â‚¬Â¦Ãƒâ€šÃ‚Â¾ÃƒÆ’Ã†â€™ÃƒÂ¢Ã¢â€šÂ¬Ã…Â¡ÃƒÆ’Ã¢â‚¬Å¡Ãƒâ€šÃ‚Â¢ÃƒÆ’Ã†â€™Ãƒâ€ Ã¢â‚¬â„¢ÃƒÆ’Ã¢â‚¬Â ÃƒÂ¢Ã¢â€šÂ¬Ã¢â€žÂ¢ÃƒÆ’Ã†â€™ÃƒÂ¢Ã¢â€šÂ¬Ã‚Â ÃƒÆ’Ã‚Â¢ÃƒÂ¢Ã¢â‚¬Å¡Ã‚Â¬ÃƒÂ¢Ã¢â‚¬Å¾Ã‚Â¢ÃƒÆ’Ã†â€™Ãƒâ€ Ã¢â‚¬â„¢ÃƒÆ’Ã‚Â¢ÃƒÂ¢Ã¢â‚¬Å¡Ã‚Â¬Ãƒâ€šÃ‚Â ÃƒÆ’Ã†â€™Ãƒâ€šÃ‚Â¢ÃƒÆ’Ã‚Â¢ÃƒÂ¢Ã¢â€šÂ¬Ã…Â¡Ãƒâ€šÃ‚Â¬ÃƒÆ’Ã‚Â¢ÃƒÂ¢Ã¢â€šÂ¬Ã…Â¾Ãƒâ€šÃ‚Â¢ÃƒÆ’Ã†â€™Ãƒâ€ Ã¢â‚¬â„¢ÃƒÆ’Ã¢â‚¬Â ÃƒÂ¢Ã¢â€šÂ¬Ã¢â€žÂ¢ÃƒÆ’Ã†â€™Ãƒâ€šÃ‚Â¢ÃƒÆ’Ã‚Â¢ÃƒÂ¢Ã¢â€šÂ¬Ã…Â¡Ãƒâ€šÃ‚Â¬ÃƒÆ’Ã¢â‚¬Â¦Ãƒâ€šÃ‚Â¡ÃƒÆ’Ã†â€™Ãƒâ€ Ã¢â‚¬â„¢ÃƒÆ’Ã‚Â¢ÃƒÂ¢Ã¢â‚¬Å¡Ã‚Â¬Ãƒâ€¦Ã‚Â¡ÃƒÆ’Ã†â€™ÃƒÂ¢Ã¢â€šÂ¬Ã…Â¡ÃƒÆ’Ã¢â‚¬Å¡Ãƒâ€šÃ‚Â¢ÃƒÆ’Ã†â€™Ãƒâ€ Ã¢â‚¬â„¢ÃƒÆ’Ã¢â‚¬Â ÃƒÂ¢Ã¢â€šÂ¬Ã¢â€žÂ¢ÃƒÆ’Ã†â€™ÃƒÂ¢Ã¢â€šÂ¬Ã‚Â ÃƒÆ’Ã‚Â¢ÃƒÂ¢Ã¢â‚¬Å¡Ã‚Â¬ÃƒÂ¢Ã¢â‚¬Å¾Ã‚Â¢ÃƒÆ’Ã†â€™Ãƒâ€ Ã¢â‚¬â„¢ÃƒÆ’Ã‚Â¢ÃƒÂ¢Ã¢â‚¬Å¡Ã‚Â¬Ãƒâ€¦Ã‚Â¡ÃƒÆ’Ã†â€™ÃƒÂ¢Ã¢â€šÂ¬Ã…Â¡ÃƒÆ’Ã¢â‚¬Å¡Ãƒâ€šÃ‚Â¢ÃƒÆ’Ã†â€™Ãƒâ€ Ã¢â‚¬â„¢ÃƒÆ’Ã¢â‚¬Â ÃƒÂ¢Ã¢â€šÂ¬Ã¢â€žÂ¢ÃƒÆ’Ã†â€™ÃƒÂ¢Ã¢â€šÂ¬Ã…Â¡ÃƒÆ’Ã¢â‚¬Å¡Ãƒâ€šÃ‚Â¢ÃƒÆ’Ã†â€™Ãƒâ€ Ã¢â‚¬â„¢ÃƒÆ’Ã¢â‚¬Å¡Ãƒâ€šÃ‚Â¢ÃƒÆ’Ã†â€™Ãƒâ€šÃ‚Â¢ÃƒÆ’Ã‚Â¢ÃƒÂ¢Ã¢â€šÂ¬Ã…Â¡Ãƒâ€šÃ‚Â¬ÃƒÆ’Ã¢â‚¬Â¦Ãƒâ€šÃ‚Â¡ÃƒÆ’Ã†â€™ÃƒÂ¢Ã¢â€šÂ¬Ã…Â¡ÃƒÆ’Ã¢â‚¬Å¡Ãƒâ€šÃ‚Â¬ÃƒÆ’Ã†â€™Ãƒâ€ Ã¢â‚¬â„¢ÃƒÆ’Ã‚Â¢ÃƒÂ¢Ã¢â‚¬Å¡Ã‚Â¬Ãƒâ€šÃ‚Â¦ÃƒÆ’Ã†â€™ÃƒÂ¢Ã¢â€šÂ¬Ã…Â¡ÃƒÆ’Ã¢â‚¬Å¡Ãƒâ€šÃ‚Â¡ÃƒÆ’Ã†â€™Ãƒâ€ Ã¢â‚¬â„¢ÃƒÆ’Ã¢â‚¬Â ÃƒÂ¢Ã¢â€šÂ¬Ã¢â€žÂ¢ÃƒÆ’Ã†â€™Ãƒâ€šÃ‚Â¢ÃƒÆ’Ã‚Â¢ÃƒÂ¢Ã¢â€šÂ¬Ã…Â¡Ãƒâ€šÃ‚Â¬ÃƒÆ’Ã¢â‚¬Â¦Ãƒâ€šÃ‚Â¡ÃƒÆ’Ã†â€™Ãƒâ€ Ã¢â‚¬â„¢ÃƒÆ’Ã‚Â¢ÃƒÂ¢Ã¢â‚¬Å¡Ã‚Â¬Ãƒâ€¦Ã‚Â¡ÃƒÆ’Ã†â€™ÃƒÂ¢Ã¢â€šÂ¬Ã…Â¡ÃƒÆ’Ã¢â‚¬Å¡Ãƒâ€šÃ‚Â¬ÃƒÆ’Ã†â€™Ãƒâ€ Ã¢â‚¬â„¢ÃƒÆ’Ã¢â‚¬Â ÃƒÂ¢Ã¢â€šÂ¬Ã¢â€žÂ¢ÃƒÆ’Ã†â€™ÃƒÂ¢Ã¢â€šÂ¬Ã‚Â ÃƒÆ’Ã‚Â¢ÃƒÂ¢Ã¢â‚¬Å¡Ã‚Â¬ÃƒÂ¢Ã¢â‚¬Å¾Ã‚Â¢ÃƒÆ’Ã†â€™Ãƒâ€ Ã¢â‚¬â„¢ÃƒÆ’Ã¢â‚¬Å¡Ãƒâ€šÃ‚Â¢ÃƒÆ’Ã†â€™Ãƒâ€šÃ‚Â¢ÃƒÆ’Ã‚Â¢ÃƒÂ¢Ã¢â‚¬Å¡Ã‚Â¬Ãƒâ€¦Ã‚Â¡ÃƒÆ’Ã¢â‚¬Å¡Ãƒâ€šÃ‚Â¬ÃƒÆ’Ã†â€™ÃƒÂ¢Ã¢â€šÂ¬Ã…Â¡ÃƒÆ’Ã¢â‚¬Å¡Ãƒâ€šÃ‚Â¦ÃƒÆ’Ã†â€™Ãƒâ€ Ã¢â‚¬â„¢ÃƒÆ’Ã¢â‚¬Â ÃƒÂ¢Ã¢â€šÂ¬Ã¢â€žÂ¢ÃƒÆ’Ã†â€™Ãƒâ€šÃ‚Â¢ÃƒÆ’Ã‚Â¢ÃƒÂ¢Ã¢â€šÂ¬Ã…Â¡Ãƒâ€šÃ‚Â¬ÃƒÆ’Ã¢â‚¬Â¦Ãƒâ€šÃ‚Â¡ÃƒÆ’Ã†â€™Ãƒâ€ Ã¢â‚¬â„¢ÃƒÆ’Ã‚Â¢ÃƒÂ¢Ã¢â‚¬Å¡Ã‚Â¬Ãƒâ€¦Ã‚Â¡ÃƒÆ’Ã†â€™ÃƒÂ¢Ã¢â€šÂ¬Ã…Â¡ÃƒÆ’Ã¢â‚¬Å¡Ãƒâ€šÃ‚Â¡ÃƒÆ’Ã†â€™Ãƒâ€ Ã¢â‚¬â„¢ÃƒÆ’Ã¢â‚¬Â ÃƒÂ¢Ã¢â€šÂ¬Ã¢â€žÂ¢ÃƒÆ’Ã†â€™ÃƒÂ¢Ã¢â€šÂ¬Ã‚Â ÃƒÆ’Ã‚Â¢ÃƒÂ¢Ã¢â‚¬Å¡Ã‚Â¬ÃƒÂ¢Ã¢â‚¬Å¾Ã‚Â¢ÃƒÆ’Ã†â€™Ãƒâ€ Ã¢â‚¬â„¢ÃƒÆ’Ã‚Â¢ÃƒÂ¢Ã¢â‚¬Å¡Ã‚Â¬Ãƒâ€šÃ‚Â ÃƒÆ’Ã†â€™Ãƒâ€šÃ‚Â¢ÃƒÆ’Ã‚Â¢ÃƒÂ¢Ã¢â€šÂ¬Ã…Â¡Ãƒâ€šÃ‚Â¬ÃƒÆ’Ã‚Â¢ÃƒÂ¢Ã¢â€šÂ¬Ã…Â¾Ãƒâ€šÃ‚Â¢ÃƒÆ’Ã†â€™Ãƒâ€ Ã¢â‚¬â„¢ÃƒÆ’Ã¢â‚¬Â ÃƒÂ¢Ã¢â€šÂ¬Ã¢â€žÂ¢ÃƒÆ’Ã†â€™Ãƒâ€šÃ‚Â¢ÃƒÆ’Ã‚Â¢ÃƒÂ¢Ã¢â€šÂ¬Ã…Â¡Ãƒâ€šÃ‚Â¬ÃƒÆ’Ã¢â‚¬Å¡Ãƒâ€šÃ‚Â ÃƒÆ’Ã†â€™Ãƒâ€ Ã¢â‚¬â„¢ÃƒÆ’Ã¢â‚¬Å¡Ãƒâ€šÃ‚Â¢ÃƒÆ’Ã†â€™Ãƒâ€šÃ‚Â¢ÃƒÆ’Ã‚Â¢ÃƒÂ¢Ã¢â‚¬Å¡Ã‚Â¬Ãƒâ€¦Ã‚Â¡ÃƒÆ’Ã¢â‚¬Å¡Ãƒâ€šÃ‚Â¬ÃƒÆ’Ã†â€™Ãƒâ€šÃ‚Â¢ÃƒÆ’Ã‚Â¢ÃƒÂ¢Ã¢â‚¬Å¡Ã‚Â¬Ãƒâ€¦Ã‚Â¾ÃƒÆ’Ã¢â‚¬Å¡Ãƒâ€šÃ‚Â¢ÃƒÆ’Ã†â€™Ãƒâ€ Ã¢â‚¬â„¢ÃƒÆ’Ã¢â‚¬Â ÃƒÂ¢Ã¢â€šÂ¬Ã¢â€žÂ¢ÃƒÆ’Ã†â€™ÃƒÂ¢Ã¢â€šÂ¬Ã‚Â ÃƒÆ’Ã‚Â¢ÃƒÂ¢Ã¢â‚¬Å¡Ã‚Â¬ÃƒÂ¢Ã¢â‚¬Å¾Ã‚Â¢ÃƒÆ’Ã†â€™Ãƒâ€ Ã¢â‚¬â„¢ÃƒÆ’Ã‚Â¢ÃƒÂ¢Ã¢â‚¬Å¡Ã‚Â¬Ãƒâ€¦Ã‚Â¡ÃƒÆ’Ã†â€™ÃƒÂ¢Ã¢â€šÂ¬Ã…Â¡ÃƒÆ’Ã¢â‚¬Å¡Ãƒâ€šÃ‚Â¢ÃƒÆ’Ã†â€™Ãƒâ€ Ã¢â‚¬â„¢ÃƒÆ’Ã¢â‚¬Â ÃƒÂ¢Ã¢â€šÂ¬Ã¢â€žÂ¢ÃƒÆ’Ã†â€™ÃƒÂ¢Ã¢â€šÂ¬Ã…Â¡ÃƒÆ’Ã¢â‚¬Å¡Ãƒâ€šÃ‚Â¢ÃƒÆ’Ã†â€™Ãƒâ€ Ã¢â‚¬â„¢ÃƒÆ’Ã¢â‚¬Å¡Ãƒâ€šÃ‚Â¢ÃƒÆ’Ã†â€™Ãƒâ€šÃ‚Â¢ÃƒÆ’Ã‚Â¢ÃƒÂ¢Ã¢â‚¬Å¡Ã‚Â¬Ãƒâ€¦Ã‚Â¡ÃƒÆ’Ã¢â‚¬Å¡Ãƒâ€šÃ‚Â¬ÃƒÆ’Ã†â€™ÃƒÂ¢Ã¢â€šÂ¬Ã‚Â¦ÃƒÆ’Ã¢â‚¬Å¡Ãƒâ€šÃ‚Â¡ÃƒÆ’Ã†â€™Ãƒâ€ Ã¢â‚¬â„¢ÃƒÆ’Ã‚Â¢ÃƒÂ¢Ã¢â‚¬Å¡Ã‚Â¬Ãƒâ€¦Ã‚Â¡ÃƒÆ’Ã†â€™ÃƒÂ¢Ã¢â€šÂ¬Ã…Â¡ÃƒÆ’Ã¢â‚¬Å¡Ãƒâ€šÃ‚Â¬ÃƒÆ’Ã†â€™Ãƒâ€ Ã¢â‚¬â„¢ÃƒÆ’Ã¢â‚¬Â ÃƒÂ¢Ã¢â€šÂ¬Ã¢â€žÂ¢ÃƒÆ’Ã†â€™Ãƒâ€šÃ‚Â¢ÃƒÆ’Ã‚Â¢ÃƒÂ¢Ã¢â€šÂ¬Ã…Â¡Ãƒâ€šÃ‚Â¬ÃƒÆ’Ã¢â‚¬Å¡Ãƒâ€šÃ‚Â¦ÃƒÆ’Ã†â€™Ãƒâ€ Ã¢â‚¬â„¢ÃƒÆ’Ã‚Â¢ÃƒÂ¢Ã¢â‚¬Å¡Ã‚Â¬Ãƒâ€¦Ã‚Â¡ÃƒÆ’Ã†â€™ÃƒÂ¢Ã¢â€šÂ¬Ã…Â¡ÃƒÆ’Ã¢â‚¬Å¡Ãƒâ€šÃ‚Â¡ÃƒÆ’Ã†â€™Ãƒâ€ Ã¢â‚¬â„¢ÃƒÆ’Ã¢â‚¬Â ÃƒÂ¢Ã¢â€šÂ¬Ã¢â€žÂ¢ÃƒÆ’Ã†â€™ÃƒÂ¢Ã¢â€šÂ¬Ã‚Â ÃƒÆ’Ã‚Â¢ÃƒÂ¢Ã¢â‚¬Å¡Ã‚Â¬ÃƒÂ¢Ã¢â‚¬Å¾Ã‚Â¢ÃƒÆ’Ã†â€™Ãƒâ€ Ã¢â‚¬â„¢ÃƒÆ’Ã‚Â¢ÃƒÂ¢Ã¢â‚¬Å¡Ã‚Â¬Ãƒâ€šÃ‚Â ÃƒÆ’Ã†â€™Ãƒâ€šÃ‚Â¢ÃƒÆ’Ã‚Â¢ÃƒÂ¢Ã¢â€šÂ¬Ã…Â¡Ãƒâ€šÃ‚Â¬ÃƒÆ’Ã‚Â¢ÃƒÂ¢Ã¢â€šÂ¬Ã…Â¾Ãƒâ€šÃ‚Â¢ÃƒÆ’Ã†â€™Ãƒâ€ Ã¢â‚¬â„¢ÃƒÆ’Ã¢â‚¬Â ÃƒÂ¢Ã¢â€šÂ¬Ã¢â€žÂ¢ÃƒÆ’Ã†â€™ÃƒÂ¢Ã¢â€šÂ¬Ã…Â¡ÃƒÆ’Ã¢â‚¬Å¡Ãƒâ€šÃ‚Â¢ÃƒÆ’Ã†â€™Ãƒâ€ Ã¢â‚¬â„¢ÃƒÆ’Ã¢â‚¬Å¡Ãƒâ€šÃ‚Â¢ÃƒÆ’Ã†â€™Ãƒâ€šÃ‚Â¢ÃƒÆ’Ã‚Â¢ÃƒÂ¢Ã¢â€šÂ¬Ã…Â¡Ãƒâ€šÃ‚Â¬ÃƒÆ’Ã¢â‚¬Â¦Ãƒâ€šÃ‚Â¡ÃƒÆ’Ã†â€™ÃƒÂ¢Ã¢â€šÂ¬Ã…Â¡ÃƒÆ’Ã¢â‚¬Å¡Ãƒâ€šÃ‚Â¬ÃƒÆ’Ã†â€™Ãƒâ€ Ã¢â‚¬â„¢ÃƒÆ’Ã‚Â¢ÃƒÂ¢Ã¢â‚¬Å¡Ã‚Â¬Ãƒâ€šÃ‚Â¦ÃƒÆ’Ã†â€™ÃƒÂ¢Ã¢â€šÂ¬Ã…Â¡ÃƒÆ’Ã¢â‚¬Å¡Ãƒâ€šÃ‚Â¡ÃƒÆ’Ã†â€™Ãƒâ€ Ã¢â‚¬â„¢ÃƒÆ’Ã¢â‚¬Â ÃƒÂ¢Ã¢â€šÂ¬Ã¢â€žÂ¢ÃƒÆ’Ã†â€™ÃƒÂ¢Ã¢â€šÂ¬Ã‚Â ÃƒÆ’Ã‚Â¢ÃƒÂ¢Ã¢â‚¬Å¡Ã‚Â¬ÃƒÂ¢Ã¢â‚¬Å¾Ã‚Â¢ÃƒÆ’Ã†â€™Ãƒâ€ Ã¢â‚¬â„¢ÃƒÆ’Ã¢â‚¬Å¡Ãƒâ€šÃ‚Â¢ÃƒÆ’Ã†â€™Ãƒâ€šÃ‚Â¢ÃƒÆ’Ã‚Â¢ÃƒÂ¢Ã¢â‚¬Å¡Ã‚Â¬Ãƒâ€¦Ã‚Â¡ÃƒÆ’Ã¢â‚¬Å¡Ãƒâ€šÃ‚Â¬ÃƒÆ’Ã†â€™ÃƒÂ¢Ã¢â€šÂ¬Ã‚Â¦ÃƒÆ’Ã¢â‚¬Å¡Ãƒâ€šÃ‚Â¡ÃƒÆ’Ã†â€™Ãƒâ€ Ã¢â‚¬â„¢ÃƒÆ’Ã¢â‚¬Â ÃƒÂ¢Ã¢â€šÂ¬Ã¢â€žÂ¢ÃƒÆ’Ã†â€™Ãƒâ€šÃ‚Â¢ÃƒÆ’Ã‚Â¢ÃƒÂ¢Ã¢â€šÂ¬Ã…Â¡Ãƒâ€šÃ‚Â¬ÃƒÆ’Ã¢â‚¬Â¦Ãƒâ€šÃ‚Â¡ÃƒÆ’Ã†â€™Ãƒâ€ Ã¢â‚¬â„¢ÃƒÆ’Ã‚Â¢ÃƒÂ¢Ã¢â‚¬Å¡Ã‚Â¬Ãƒâ€¦Ã‚Â¡ÃƒÆ’Ã†â€™ÃƒÂ¢Ã¢â€šÂ¬Ã…Â¡ÃƒÆ’Ã¢â‚¬Å¡Ãƒâ€šÃ‚Â³ÃƒÆ’Ã†â€™Ãƒâ€ Ã¢â‚¬â„¢ÃƒÆ’Ã¢â‚¬Â ÃƒÂ¢Ã¢â€šÂ¬Ã¢â€žÂ¢ÃƒÆ’Ã†â€™ÃƒÂ¢Ã¢â€šÂ¬Ã‚Â ÃƒÆ’Ã‚Â¢ÃƒÂ¢Ã¢â‚¬Å¡Ã‚Â¬ÃƒÂ¢Ã¢â‚¬Å¾Ã‚Â¢ÃƒÆ’Ã†â€™Ãƒâ€ Ã¢â‚¬â„¢ÃƒÆ’Ã‚Â¢ÃƒÂ¢Ã¢â‚¬Å¡Ã‚Â¬Ãƒâ€šÃ‚Â ÃƒÆ’Ã†â€™Ãƒâ€šÃ‚Â¢ÃƒÆ’Ã‚Â¢ÃƒÂ¢Ã¢â€šÂ¬Ã…Â¡Ãƒâ€šÃ‚Â¬ÃƒÆ’Ã‚Â¢ÃƒÂ¢Ã¢â€šÂ¬Ã…Â¾Ãƒâ€šÃ‚Â¢ÃƒÆ’Ã†â€™Ãƒâ€ Ã¢â‚¬â„¢ÃƒÆ’Ã¢â‚¬Â ÃƒÂ¢Ã¢â€šÂ¬Ã¢â€žÂ¢ÃƒÆ’Ã†â€™Ãƒâ€šÃ‚Â¢ÃƒÆ’Ã‚Â¢ÃƒÂ¢Ã¢â€šÂ¬Ã…Â¡Ãƒâ€šÃ‚Â¬ÃƒÆ’Ã¢â‚¬Å¡Ãƒâ€šÃ‚Â ÃƒÆ’Ã†â€™Ãƒâ€ Ã¢â‚¬â„¢ÃƒÆ’Ã¢â‚¬Å¡Ãƒâ€šÃ‚Â¢ÃƒÆ’Ã†â€™Ãƒâ€šÃ‚Â¢ÃƒÆ’Ã‚Â¢ÃƒÂ¢Ã¢â‚¬Å¡Ã‚Â¬Ãƒâ€¦Ã‚Â¡ÃƒÆ’Ã¢â‚¬Å¡Ãƒâ€šÃ‚Â¬ÃƒÆ’Ã†â€™Ãƒâ€šÃ‚Â¢ÃƒÆ’Ã‚Â¢ÃƒÂ¢Ã¢â‚¬Å¡Ã‚Â¬Ãƒâ€¦Ã‚Â¾ÃƒÆ’Ã¢â‚¬Å¡Ãƒâ€šÃ‚Â¢ÃƒÆ’Ã†â€™Ãƒâ€ Ã¢â‚¬â„¢ÃƒÆ’Ã¢â‚¬Â ÃƒÂ¢Ã¢â€šÂ¬Ã¢â€žÂ¢ÃƒÆ’Ã†â€™ÃƒÂ¢Ã¢â€šÂ¬Ã‚Â ÃƒÆ’Ã‚Â¢ÃƒÂ¢Ã¢â‚¬Å¡Ã‚Â¬ÃƒÂ¢Ã¢â‚¬Å¾Ã‚Â¢ÃƒÆ’Ã†â€™Ãƒâ€ Ã¢â‚¬â„¢ÃƒÆ’Ã¢â‚¬Å¡Ãƒâ€šÃ‚Â¢ÃƒÆ’Ã†â€™Ãƒâ€šÃ‚Â¢ÃƒÆ’Ã‚Â¢ÃƒÂ¢Ã¢â‚¬Å¡Ã‚Â¬Ãƒâ€¦Ã‚Â¡ÃƒÆ’Ã¢â‚¬Å¡Ãƒâ€šÃ‚Â¬ÃƒÆ’Ã†â€™ÃƒÂ¢Ã¢â€šÂ¬Ã…Â¡ÃƒÆ’Ã¢â‚¬Å¡Ãƒâ€šÃ‚Â ÃƒÆ’Ã†â€™Ãƒâ€ Ã¢â‚¬â„¢ÃƒÆ’Ã¢â‚¬Â ÃƒÂ¢Ã¢â€šÂ¬Ã¢â€žÂ¢ÃƒÆ’Ã†â€™ÃƒÂ¢Ã¢â€šÂ¬Ã…Â¡ÃƒÆ’Ã¢â‚¬Å¡Ãƒâ€šÃ‚Â¢ÃƒÆ’Ã†â€™Ãƒâ€ Ã¢â‚¬â„¢ÃƒÆ’Ã¢â‚¬Å¡Ãƒâ€šÃ‚Â¢ÃƒÆ’Ã†â€™Ãƒâ€šÃ‚Â¢ÃƒÆ’Ã‚Â¢ÃƒÂ¢Ã¢â€šÂ¬Ã…Â¡Ãƒâ€šÃ‚Â¬ÃƒÆ’Ã¢â‚¬Â¦Ãƒâ€šÃ‚Â¡ÃƒÆ’Ã†â€™ÃƒÂ¢Ã¢â€šÂ¬Ã…Â¡ÃƒÆ’Ã¢â‚¬Å¡Ãƒâ€šÃ‚Â¬ÃƒÆ’Ã†â€™Ãƒâ€ Ã¢â‚¬â„¢ÃƒÆ’Ã¢â‚¬Å¡Ãƒâ€šÃ‚Â¢ÃƒÆ’Ã†â€™Ãƒâ€šÃ‚Â¢ÃƒÆ’Ã‚Â¢ÃƒÂ¢Ã¢â€šÂ¬Ã…Â¡Ãƒâ€šÃ‚Â¬ÃƒÆ’Ã¢â‚¬Â¦Ãƒâ€šÃ‚Â¾ÃƒÆ’Ã†â€™ÃƒÂ¢Ã¢â€šÂ¬Ã…Â¡ÃƒÆ’Ã¢â‚¬Å¡Ãƒâ€šÃ‚Â¢ÃƒÆ’Ã†â€™Ãƒâ€ Ã¢â‚¬â„¢ÃƒÆ’Ã¢â‚¬Â ÃƒÂ¢Ã¢â€šÂ¬Ã¢â€žÂ¢ÃƒÆ’Ã†â€™ÃƒÂ¢Ã¢â€šÂ¬Ã‚Â ÃƒÆ’Ã‚Â¢ÃƒÂ¢Ã¢â‚¬Å¡Ã‚Â¬ÃƒÂ¢Ã¢â‚¬Å¾Ã‚Â¢ÃƒÆ’Ã†â€™Ãƒâ€ Ã¢â‚¬â„¢ÃƒÆ’Ã‚Â¢ÃƒÂ¢Ã¢â‚¬Å¡Ã‚Â¬Ãƒâ€šÃ‚Â ÃƒÆ’Ã†â€™Ãƒâ€šÃ‚Â¢ÃƒÆ’Ã‚Â¢ÃƒÂ¢Ã¢â€šÂ¬Ã…Â¡Ãƒâ€šÃ‚Â¬ÃƒÆ’Ã‚Â¢ÃƒÂ¢Ã¢â€šÂ¬Ã…Â¾Ãƒâ€šÃ‚Â¢ÃƒÆ’Ã†â€™Ãƒâ€ Ã¢â‚¬â„¢ÃƒÆ’Ã¢â‚¬Â ÃƒÂ¢Ã¢â€šÂ¬Ã¢â€žÂ¢ÃƒÆ’Ã†â€™ÃƒÂ¢Ã¢â€šÂ¬Ã…Â¡ÃƒÆ’Ã¢â‚¬Å¡Ãƒâ€šÃ‚Â¢ÃƒÆ’Ã†â€™Ãƒâ€ Ã¢â‚¬â„¢ÃƒÆ’Ã¢â‚¬Å¡Ãƒâ€šÃ‚Â¢ÃƒÆ’Ã†â€™Ãƒâ€šÃ‚Â¢ÃƒÆ’Ã‚Â¢ÃƒÂ¢Ã¢â€šÂ¬Ã…Â¡Ãƒâ€šÃ‚Â¬ÃƒÆ’Ã¢â‚¬Â¦Ãƒâ€šÃ‚Â¡ÃƒÆ’Ã†â€™ÃƒÂ¢Ã¢â€šÂ¬Ã…Â¡ÃƒÆ’Ã¢â‚¬Å¡Ãƒâ€šÃ‚Â¬ÃƒÆ’Ã†â€™Ãƒâ€ Ã¢â‚¬â„¢ÃƒÆ’Ã‚Â¢ÃƒÂ¢Ã¢â‚¬Å¡Ã‚Â¬Ãƒâ€šÃ‚Â¦ÃƒÆ’Ã†â€™ÃƒÂ¢Ã¢â€šÂ¬Ã…Â¡ÃƒÆ’Ã¢â‚¬Å¡Ãƒâ€šÃ‚Â¡ÃƒÆ’Ã†â€™Ãƒâ€ Ã¢â‚¬â„¢ÃƒÆ’Ã¢â‚¬Â ÃƒÂ¢Ã¢â€šÂ¬Ã¢â€žÂ¢ÃƒÆ’Ã†â€™ÃƒÂ¢Ã¢â€šÂ¬Ã‚Â ÃƒÆ’Ã‚Â¢ÃƒÂ¢Ã¢â‚¬Å¡Ã‚Â¬ÃƒÂ¢Ã¢â‚¬Å¾Ã‚Â¢ÃƒÆ’Ã†â€™Ãƒâ€ Ã¢â‚¬â„¢ÃƒÆ’Ã¢â‚¬Å¡Ãƒâ€šÃ‚Â¢ÃƒÆ’Ã†â€™Ãƒâ€šÃ‚Â¢ÃƒÆ’Ã‚Â¢ÃƒÂ¢Ã¢â‚¬Å¡Ã‚Â¬Ãƒâ€¦Ã‚Â¡ÃƒÆ’Ã¢â‚¬Å¡Ãƒâ€šÃ‚Â¬ÃƒÆ’Ã†â€™ÃƒÂ¢Ã¢â€šÂ¬Ã‚Â¦ÃƒÆ’Ã¢â‚¬Å¡Ãƒâ€šÃ‚Â¡ÃƒÆ’Ã†â€™Ãƒâ€ Ã¢â‚¬â„¢ÃƒÆ’Ã¢â‚¬Â ÃƒÂ¢Ã¢â€šÂ¬Ã¢â€žÂ¢ÃƒÆ’Ã†â€™Ãƒâ€šÃ‚Â¢ÃƒÆ’Ã‚Â¢ÃƒÂ¢Ã¢â€šÂ¬Ã…Â¡Ãƒâ€šÃ‚Â¬ÃƒÆ’Ã¢â‚¬Â¦Ãƒâ€šÃ‚Â¡ÃƒÆ’Ã†â€™Ãƒâ€ Ã¢â‚¬â„¢ÃƒÆ’Ã‚Â¢ÃƒÂ¢Ã¢â‚¬Å¡Ã‚Â¬Ãƒâ€¦Ã‚Â¡ÃƒÆ’Ã†â€™ÃƒÂ¢Ã¢â€šÂ¬Ã…Â¡ÃƒÆ’Ã¢â‚¬Å¡Ãƒâ€šÃ‚Â¢ÃƒÆ’Ã†â€™Ãƒâ€ Ã¢â‚¬â„¢ÃƒÆ’Ã¢â‚¬Â ÃƒÂ¢Ã¢â€šÂ¬Ã¢â€žÂ¢ÃƒÆ’Ã†â€™ÃƒÂ¢Ã¢â€šÂ¬Ã‚Â ÃƒÆ’Ã‚Â¢ÃƒÂ¢Ã¢â‚¬Å¡Ã‚Â¬ÃƒÂ¢Ã¢â‚¬Å¾Ã‚Â¢ÃƒÆ’Ã†â€™Ãƒâ€ Ã¢â‚¬â„¢ÃƒÆ’Ã‚Â¢ÃƒÂ¢Ã¢â‚¬Å¡Ã‚Â¬Ãƒâ€šÃ‚Â ÃƒÆ’Ã†â€™Ãƒâ€šÃ‚Â¢ÃƒÆ’Ã‚Â¢ÃƒÂ¢Ã¢â€šÂ¬Ã…Â¡Ãƒâ€šÃ‚Â¬ÃƒÆ’Ã‚Â¢ÃƒÂ¢Ã¢â€šÂ¬Ã…Â¾Ãƒâ€šÃ‚Â¢ÃƒÆ’Ã†â€™Ãƒâ€ Ã¢â‚¬â„¢ÃƒÆ’Ã¢â‚¬Â ÃƒÂ¢Ã¢â€šÂ¬Ã¢â€žÂ¢ÃƒÆ’Ã†â€™Ãƒâ€šÃ‚Â¢ÃƒÆ’Ã‚Â¢ÃƒÂ¢Ã¢â€šÂ¬Ã…Â¡Ãƒâ€šÃ‚Â¬ÃƒÆ’Ã¢â‚¬Å¡Ãƒâ€šÃ‚Â ÃƒÆ’Ã†â€™Ãƒâ€ Ã¢â‚¬â„¢ÃƒÆ’Ã¢â‚¬Å¡Ãƒâ€šÃ‚Â¢ÃƒÆ’Ã†â€™Ãƒâ€šÃ‚Â¢ÃƒÆ’Ã‚Â¢ÃƒÂ¢Ã¢â‚¬Å¡Ã‚Â¬Ãƒâ€¦Ã‚Â¡ÃƒÆ’Ã¢â‚¬Å¡Ãƒâ€šÃ‚Â¬ÃƒÆ’Ã†â€™Ãƒâ€šÃ‚Â¢ÃƒÆ’Ã‚Â¢ÃƒÂ¢Ã¢â‚¬Å¡Ã‚Â¬Ãƒâ€¦Ã‚Â¾ÃƒÆ’Ã¢â‚¬Å¡Ãƒâ€šÃ‚Â¢ÃƒÆ’Ã†â€™Ãƒâ€ Ã¢â‚¬â„¢ÃƒÆ’Ã¢â‚¬Â ÃƒÂ¢Ã¢â€šÂ¬Ã¢â€žÂ¢ÃƒÆ’Ã†â€™ÃƒÂ¢Ã¢â€šÂ¬Ã‚Â ÃƒÆ’Ã‚Â¢ÃƒÂ¢Ã¢â‚¬Å¡Ã‚Â¬ÃƒÂ¢Ã¢â‚¬Å¾Ã‚Â¢ÃƒÆ’Ã†â€™Ãƒâ€ Ã¢â‚¬â„¢ÃƒÆ’Ã‚Â¢ÃƒÂ¢Ã¢â‚¬Å¡Ã‚Â¬Ãƒâ€¦Ã‚Â¡ÃƒÆ’Ã†â€™ÃƒÂ¢Ã¢â€šÂ¬Ã…Â¡ÃƒÆ’Ã¢â‚¬Å¡Ãƒâ€šÃ‚Â¢ÃƒÆ’Ã†â€™Ãƒâ€ Ã¢â‚¬â„¢ÃƒÆ’Ã¢â‚¬Â ÃƒÂ¢Ã¢â€šÂ¬Ã¢â€žÂ¢ÃƒÆ’Ã†â€™ÃƒÂ¢Ã¢â€šÂ¬Ã…Â¡ÃƒÆ’Ã¢â‚¬Å¡Ãƒâ€šÃ‚Â¢ÃƒÆ’Ã†â€™Ãƒâ€ Ã¢â‚¬â„¢ÃƒÆ’Ã¢â‚¬Å¡Ãƒâ€šÃ‚Â¢ÃƒÆ’Ã†â€™Ãƒâ€šÃ‚Â¢ÃƒÆ’Ã‚Â¢ÃƒÂ¢Ã¢â‚¬Å¡Ã‚Â¬Ãƒâ€¦Ã‚Â¡ÃƒÆ’Ã¢â‚¬Å¡Ãƒâ€šÃ‚Â¬ÃƒÆ’Ã†â€™ÃƒÂ¢Ã¢â€šÂ¬Ã‚Â¦ÃƒÆ’Ã¢â‚¬Å¡Ãƒâ€šÃ‚Â¡ÃƒÆ’Ã†â€™Ãƒâ€ Ã¢â‚¬â„¢ÃƒÆ’Ã‚Â¢ÃƒÂ¢Ã¢â‚¬Å¡Ã‚Â¬Ãƒâ€¦Ã‚Â¡ÃƒÆ’Ã†â€™ÃƒÂ¢Ã¢â€šÂ¬Ã…Â¡ÃƒÆ’Ã¢â‚¬Å¡Ãƒâ€šÃ‚Â¬ÃƒÆ’Ã†â€™Ãƒâ€ Ã¢â‚¬â„¢ÃƒÆ’Ã¢â‚¬Â ÃƒÂ¢Ã¢â€šÂ¬Ã¢â€žÂ¢ÃƒÆ’Ã†â€™Ãƒâ€šÃ‚Â¢ÃƒÆ’Ã‚Â¢ÃƒÂ¢Ã¢â€šÂ¬Ã…Â¡Ãƒâ€šÃ‚Â¬ÃƒÆ’Ã¢â‚¬Å¡Ãƒâ€šÃ‚Â¦ÃƒÆ’Ã†â€™Ãƒâ€ Ã¢â‚¬â„¢ÃƒÆ’Ã‚Â¢ÃƒÂ¢Ã¢â‚¬Å¡Ã‚Â¬Ãƒâ€¦Ã‚Â¡ÃƒÆ’Ã†â€™ÃƒÂ¢Ã¢â€šÂ¬Ã…Â¡ÃƒÆ’Ã¢â‚¬Å¡Ãƒâ€šÃ‚Â¡ÃƒÆ’Ã†â€™Ãƒâ€ Ã¢â‚¬â„¢ÃƒÆ’Ã¢â‚¬Â ÃƒÂ¢Ã¢â€šÂ¬Ã¢â€žÂ¢ÃƒÆ’Ã†â€™ÃƒÂ¢Ã¢â€šÂ¬Ã‚Â ÃƒÆ’Ã‚Â¢ÃƒÂ¢Ã¢â‚¬Å¡Ã‚Â¬ÃƒÂ¢Ã¢â‚¬Å¾Ã‚Â¢ÃƒÆ’Ã†â€™Ãƒâ€ Ã¢â‚¬â„¢ÃƒÆ’Ã‚Â¢ÃƒÂ¢Ã¢â‚¬Å¡Ã‚Â¬Ãƒâ€šÃ‚Â ÃƒÆ’Ã†â€™Ãƒâ€šÃ‚Â¢ÃƒÆ’Ã‚Â¢ÃƒÂ¢Ã¢â€šÂ¬Ã…Â¡Ãƒâ€šÃ‚Â¬ÃƒÆ’Ã‚Â¢ÃƒÂ¢Ã¢â€šÂ¬Ã…Â¾Ãƒâ€šÃ‚Â¢ÃƒÆ’Ã†â€™Ãƒâ€ Ã¢â‚¬â„¢ÃƒÆ’Ã¢â‚¬Â ÃƒÂ¢Ã¢â€šÂ¬Ã¢â€žÂ¢ÃƒÆ’Ã†â€™ÃƒÂ¢Ã¢â€šÂ¬Ã…Â¡ÃƒÆ’Ã¢â‚¬Å¡Ãƒâ€šÃ‚Â¢ÃƒÆ’Ã†â€™Ãƒâ€ Ã¢â‚¬â„¢ÃƒÆ’Ã¢â‚¬Å¡Ãƒâ€šÃ‚Â¢ÃƒÆ’Ã†â€™Ãƒâ€šÃ‚Â¢ÃƒÆ’Ã‚Â¢ÃƒÂ¢Ã¢â€šÂ¬Ã…Â¡Ãƒâ€šÃ‚Â¬ÃƒÆ’Ã¢â‚¬Â¦Ãƒâ€šÃ‚Â¡ÃƒÆ’Ã†â€™ÃƒÂ¢Ã¢â€šÂ¬Ã…Â¡ÃƒÆ’Ã¢â‚¬Å¡Ãƒâ€šÃ‚Â¬ÃƒÆ’Ã†â€™Ãƒâ€ Ã¢â‚¬â„¢ÃƒÆ’Ã‚Â¢ÃƒÂ¢Ã¢â‚¬Å¡Ã‚Â¬Ãƒâ€šÃ‚Â¦ÃƒÆ’Ã†â€™ÃƒÂ¢Ã¢â€šÂ¬Ã…Â¡ÃƒÆ’Ã¢â‚¬Å¡Ãƒâ€šÃ‚Â¡ÃƒÆ’Ã†â€™Ãƒâ€ Ã¢â‚¬â„¢ÃƒÆ’Ã¢â‚¬Â ÃƒÂ¢Ã¢â€šÂ¬Ã¢â€žÂ¢ÃƒÆ’Ã†â€™ÃƒÂ¢Ã¢â€šÂ¬Ã‚Â ÃƒÆ’Ã‚Â¢ÃƒÂ¢Ã¢â‚¬Å¡Ã‚Â¬ÃƒÂ¢Ã¢â‚¬Å¾Ã‚Â¢ÃƒÆ’Ã†â€™Ãƒâ€ Ã¢â‚¬â„¢ÃƒÆ’Ã¢â‚¬Å¡Ãƒâ€šÃ‚Â¢ÃƒÆ’Ã†â€™Ãƒâ€šÃ‚Â¢ÃƒÆ’Ã‚Â¢ÃƒÂ¢Ã¢â‚¬Å¡Ã‚Â¬Ãƒâ€¦Ã‚Â¡ÃƒÆ’Ã¢â‚¬Å¡Ãƒâ€šÃ‚Â¬ÃƒÆ’Ã†â€™ÃƒÂ¢Ã¢â€šÂ¬Ã‚Â¦ÃƒÆ’Ã¢â‚¬Å¡Ãƒâ€šÃ‚Â¡ÃƒÆ’Ã†â€™Ãƒâ€ Ã¢â‚¬â„¢ÃƒÆ’Ã¢â‚¬Â ÃƒÂ¢Ã¢â€šÂ¬Ã¢â€žÂ¢ÃƒÆ’Ã†â€™Ãƒâ€šÃ‚Â¢ÃƒÆ’Ã‚Â¢ÃƒÂ¢Ã¢â€šÂ¬Ã…Â¡Ãƒâ€šÃ‚Â¬ÃƒÆ’Ã¢â‚¬Â¦Ãƒâ€šÃ‚Â¡ÃƒÆ’Ã†â€™Ãƒâ€ Ã¢â‚¬â„¢ÃƒÆ’Ã‚Â¢ÃƒÂ¢Ã¢â‚¬Å¡Ã‚Â¬Ãƒâ€¦Ã‚Â¡ÃƒÆ’Ã†â€™ÃƒÂ¢Ã¢â€šÂ¬Ã…Â¡ÃƒÆ’Ã¢â‚¬Å¡Ãƒâ€šÃ‚ÂÃƒÆ’Ã†â€™Ãƒâ€ Ã¢â‚¬â„¢ÃƒÆ’Ã¢â‚¬Â ÃƒÂ¢Ã¢â€šÂ¬Ã¢â€žÂ¢ÃƒÆ’Ã†â€™ÃƒÂ¢Ã¢â€šÂ¬Ã‚Â ÃƒÆ’Ã‚Â¢ÃƒÂ¢Ã¢â‚¬Å¡Ã‚Â¬ÃƒÂ¢Ã¢â‚¬Å¾Ã‚Â¢ÃƒÆ’Ã†â€™Ãƒâ€ Ã¢â‚¬â„¢ÃƒÆ’Ã‚Â¢ÃƒÂ¢Ã¢â‚¬Å¡Ã‚Â¬Ãƒâ€šÃ‚Â ÃƒÆ’Ã†â€™Ãƒâ€šÃ‚Â¢ÃƒÆ’Ã‚Â¢ÃƒÂ¢Ã¢â€šÂ¬Ã…Â¡Ãƒâ€šÃ‚Â¬ÃƒÆ’Ã‚Â¢ÃƒÂ¢Ã¢â€šÂ¬Ã…Â¾Ãƒâ€šÃ‚Â¢ÃƒÆ’Ã†â€™Ãƒâ€ Ã¢â‚¬â„¢ÃƒÆ’Ã¢â‚¬Â ÃƒÂ¢Ã¢â€šÂ¬Ã¢â€žÂ¢ÃƒÆ’Ã†â€™Ãƒâ€šÃ‚Â¢ÃƒÆ’Ã‚Â¢ÃƒÂ¢Ã¢â€šÂ¬Ã…Â¡Ãƒâ€šÃ‚Â¬ÃƒÆ’Ã¢â‚¬Å¡Ãƒâ€šÃ‚Â ÃƒÆ’Ã†â€™Ãƒâ€ Ã¢â‚¬â„¢ÃƒÆ’Ã¢â‚¬Å¡Ãƒâ€šÃ‚Â¢ÃƒÆ’Ã†â€™Ãƒâ€šÃ‚Â¢ÃƒÆ’Ã‚Â¢ÃƒÂ¢Ã¢â‚¬Å¡Ã‚Â¬Ãƒâ€¦Ã‚Â¡ÃƒÆ’Ã¢â‚¬Å¡Ãƒâ€šÃ‚Â¬ÃƒÆ’Ã†â€™Ãƒâ€šÃ‚Â¢ÃƒÆ’Ã‚Â¢ÃƒÂ¢Ã¢â‚¬Å¡Ã‚Â¬Ãƒâ€¦Ã‚Â¾ÃƒÆ’Ã¢â‚¬Å¡Ãƒâ€šÃ‚Â¢ÃƒÆ’Ã†â€™Ãƒâ€ Ã¢â‚¬â„¢ÃƒÆ’Ã¢â‚¬Â ÃƒÂ¢Ã¢â€šÂ¬Ã¢â€žÂ¢ÃƒÆ’Ã†â€™ÃƒÂ¢Ã¢â€šÂ¬Ã‚Â ÃƒÆ’Ã‚Â¢ÃƒÂ¢Ã¢â‚¬Å¡Ã‚Â¬ÃƒÂ¢Ã¢â‚¬Å¾Ã‚Â¢ÃƒÆ’Ã†â€™Ãƒâ€ Ã¢â‚¬â„¢ÃƒÆ’Ã‚Â¢ÃƒÂ¢Ã¢â‚¬Å¡Ã‚Â¬Ãƒâ€¦Ã‚Â¡ÃƒÆ’Ã†â€™ÃƒÂ¢Ã¢â€šÂ¬Ã…Â¡ÃƒÆ’Ã¢â‚¬Å¡Ãƒâ€šÃ‚Â¢ÃƒÆ’Ã†â€™Ãƒâ€ Ã¢â‚¬â„¢ÃƒÆ’Ã¢â‚¬Â ÃƒÂ¢Ã¢â€šÂ¬Ã¢â€žÂ¢ÃƒÆ’Ã†â€™ÃƒÂ¢Ã¢â€šÂ¬Ã…Â¡ÃƒÆ’Ã¢â‚¬Å¡Ãƒâ€šÃ‚Â¢ÃƒÆ’Ã†â€™Ãƒâ€ Ã¢â‚¬â„¢ÃƒÆ’Ã¢â‚¬Å¡Ãƒâ€šÃ‚Â¢ÃƒÆ’Ã†â€™Ãƒâ€šÃ‚Â¢ÃƒÆ’Ã‚Â¢ÃƒÂ¢Ã¢â‚¬Å¡Ã‚Â¬Ãƒâ€¦Ã‚Â¡ÃƒÆ’Ã¢â‚¬Å¡Ãƒâ€šÃ‚Â¬ÃƒÆ’Ã†â€™ÃƒÂ¢Ã¢â€šÂ¬Ã‚Â¦ÃƒÆ’Ã¢â‚¬Å¡Ãƒâ€šÃ‚Â¡ÃƒÆ’Ã†â€™Ãƒâ€ Ã¢â‚¬â„¢ÃƒÆ’Ã‚Â¢ÃƒÂ¢Ã¢â‚¬Å¡Ã‚Â¬Ãƒâ€¦Ã‚Â¡ÃƒÆ’Ã†â€™ÃƒÂ¢Ã¢â€šÂ¬Ã…Â¡ÃƒÆ’Ã¢â‚¬Å¡Ãƒâ€šÃ‚Â¬ÃƒÆ’Ã†â€™Ãƒâ€ Ã¢â‚¬â„¢ÃƒÆ’Ã¢â‚¬Â ÃƒÂ¢Ã¢â€šÂ¬Ã¢â€žÂ¢ÃƒÆ’Ã†â€™Ãƒâ€šÃ‚Â¢ÃƒÆ’Ã‚Â¢ÃƒÂ¢Ã¢â€šÂ¬Ã…Â¡Ãƒâ€šÃ‚Â¬ÃƒÆ’Ã¢â‚¬Å¡Ãƒâ€šÃ‚Â¦ÃƒÆ’Ã†â€™Ãƒâ€ Ã¢â‚¬â„¢ÃƒÆ’Ã‚Â¢ÃƒÂ¢Ã¢â‚¬Å¡Ã‚Â¬Ãƒâ€¦Ã‚Â¡ÃƒÆ’Ã†â€™ÃƒÂ¢Ã¢â€šÂ¬Ã…Â¡ÃƒÆ’Ã¢â‚¬Å¡Ãƒâ€šÃ‚Â¡ÃƒÆ’Ã†â€™Ãƒâ€ Ã¢â‚¬â„¢ÃƒÆ’Ã¢â‚¬Â ÃƒÂ¢Ã¢â€šÂ¬Ã¢â€žÂ¢ÃƒÆ’Ã†â€™ÃƒÂ¢Ã¢â€šÂ¬Ã‚Â ÃƒÆ’Ã‚Â¢ÃƒÂ¢Ã¢â‚¬Å¡Ã‚Â¬ÃƒÂ¢Ã¢â‚¬Å¾Ã‚Â¢ÃƒÆ’Ã†â€™Ãƒâ€ Ã¢â‚¬â„¢ÃƒÆ’Ã‚Â¢ÃƒÂ¢Ã¢â‚¬Å¡Ã‚Â¬Ãƒâ€šÃ‚Â ÃƒÆ’Ã†â€™Ãƒâ€šÃ‚Â¢ÃƒÆ’Ã‚Â¢ÃƒÂ¢Ã¢â€šÂ¬Ã…Â¡Ãƒâ€šÃ‚Â¬ÃƒÆ’Ã‚Â¢ÃƒÂ¢Ã¢â€šÂ¬Ã…Â¾Ãƒâ€šÃ‚Â¢ÃƒÆ’Ã†â€™Ãƒâ€ Ã¢â‚¬â„¢ÃƒÆ’Ã¢â‚¬Â ÃƒÂ¢Ã¢â€šÂ¬Ã¢â€žÂ¢ÃƒÆ’Ã†â€™ÃƒÂ¢Ã¢â€šÂ¬Ã…Â¡ÃƒÆ’Ã¢â‚¬Å¡Ãƒâ€šÃ‚Â¢ÃƒÆ’Ã†â€™Ãƒâ€ Ã¢â‚¬â„¢ÃƒÆ’Ã¢â‚¬Å¡Ãƒâ€šÃ‚Â¢ÃƒÆ’Ã†â€™Ãƒâ€šÃ‚Â¢ÃƒÆ’Ã‚Â¢ÃƒÂ¢Ã¢â€šÂ¬Ã…Â¡Ãƒâ€šÃ‚Â¬ÃƒÆ’Ã¢â‚¬Â¦Ãƒâ€šÃ‚Â¡ÃƒÆ’Ã†â€™ÃƒÂ¢Ã¢â€šÂ¬Ã…Â¡ÃƒÆ’Ã¢â‚¬Å¡Ãƒâ€šÃ‚Â¬ÃƒÆ’Ã†â€™Ãƒâ€ Ã¢â‚¬â„¢ÃƒÆ’Ã‚Â¢ÃƒÂ¢Ã¢â‚¬Å¡Ã‚Â¬Ãƒâ€šÃ‚Â¦ÃƒÆ’Ã†â€™ÃƒÂ¢Ã¢â€šÂ¬Ã…Â¡ÃƒÆ’Ã¢â‚¬Å¡Ãƒâ€šÃ‚Â¡ÃƒÆ’Ã†â€™Ãƒâ€ Ã¢â‚¬â„¢ÃƒÆ’Ã¢â‚¬Â ÃƒÂ¢Ã¢â€šÂ¬Ã¢â€žÂ¢ÃƒÆ’Ã†â€™ÃƒÂ¢Ã¢â€šÂ¬Ã‚Â ÃƒÆ’Ã‚Â¢ÃƒÂ¢Ã¢â‚¬Å¡Ã‚Â¬ÃƒÂ¢Ã¢â‚¬Å¾Ã‚Â¢ÃƒÆ’Ã†â€™Ãƒâ€ Ã¢â‚¬â„¢ÃƒÆ’Ã¢â‚¬Å¡Ãƒâ€šÃ‚Â¢ÃƒÆ’Ã†â€™Ãƒâ€šÃ‚Â¢ÃƒÆ’Ã‚Â¢ÃƒÂ¢Ã¢â‚¬Å¡Ã‚Â¬Ãƒâ€¦Ã‚Â¡ÃƒÆ’Ã¢â‚¬Å¡Ãƒâ€šÃ‚Â¬ÃƒÆ’Ã†â€™ÃƒÂ¢Ã¢â€šÂ¬Ã‚Â¦ÃƒÆ’Ã¢â‚¬Å¡Ãƒâ€šÃ‚Â¡ÃƒÆ’Ã†â€™Ãƒâ€ Ã¢â‚¬â„¢ÃƒÆ’Ã¢â‚¬Â ÃƒÂ¢Ã¢â€šÂ¬Ã¢â€žÂ¢ÃƒÆ’Ã†â€™Ãƒâ€šÃ‚Â¢ÃƒÆ’Ã‚Â¢ÃƒÂ¢Ã¢â€šÂ¬Ã…Â¡Ãƒâ€šÃ‚Â¬ÃƒÆ’Ã¢â‚¬Â¦Ãƒâ€šÃ‚Â¡ÃƒÆ’Ã†â€™Ãƒâ€ Ã¢â‚¬â„¢ÃƒÆ’Ã‚Â¢ÃƒÂ¢Ã¢â‚¬Å¡Ã‚Â¬Ãƒâ€¦Ã‚Â¡ÃƒÆ’Ã†â€™ÃƒÂ¢Ã¢â€šÂ¬Ã…Â¡ÃƒÆ’Ã¢â‚¬Å¡Ãƒâ€šÃ‚Â») concentration (</w:t>
       </w:r>
       <w:proofErr w:type="spellStart"/>
       <w:r>
@@ -8896,7 +8896,7 @@
           <w:sz w:val="28"/>
           <w:szCs w:val="28"/>
         </w:rPr>
-        <w:t>ÃƒÆ’Ã†â€™Ãƒâ€ Ã¢â‚¬â„¢ÃƒÆ’Ã¢â‚¬Â ÃƒÂ¢Ã¢â€šÂ¬Ã¢â€žÂ¢ÃƒÆ’Ã†â€™ÃƒÂ¢Ã¢â€šÂ¬Ã‚Â ÃƒÆ’Ã‚Â¢ÃƒÂ¢Ã¢â‚¬Å¡Ã‚Â¬ÃƒÂ¢Ã¢â‚¬Å¾Ã‚Â¢ÃƒÆ’Ã†â€™Ãƒâ€ Ã¢â‚¬â„¢ÃƒÆ’Ã‚Â¢ÃƒÂ¢Ã¢â‚¬Å¡Ã‚Â¬Ãƒâ€šÃ‚Â ÃƒÆ’Ã†â€™Ãƒâ€šÃ‚Â¢ÃƒÆ’Ã‚Â¢ÃƒÂ¢Ã¢â€šÂ¬Ã…Â¡Ãƒâ€šÃ‚Â¬ÃƒÆ’Ã‚Â¢ÃƒÂ¢Ã¢â€šÂ¬Ã…Â¾Ãƒâ€šÃ‚Â¢ÃƒÆ’Ã†â€™Ãƒâ€ Ã¢â‚¬â„¢ÃƒÆ’Ã¢â‚¬Â ÃƒÂ¢Ã¢â€šÂ¬Ã¢â€žÂ¢ÃƒÆ’Ã†â€™Ãƒâ€šÃ‚Â¢ÃƒÆ’Ã‚Â¢ÃƒÂ¢Ã¢â€šÂ¬Ã…Â¡Ãƒâ€šÃ‚Â¬ÃƒÆ’Ã¢â‚¬Å¡Ãƒâ€šÃ‚Â ÃƒÆ’Ã†â€™Ãƒâ€ Ã¢â‚¬â„¢ÃƒÆ’Ã¢â‚¬Å¡Ãƒâ€šÃ‚Â¢ÃƒÆ’Ã†â€™Ãƒâ€šÃ‚Â¢ÃƒÆ’Ã‚Â¢ÃƒÂ¢Ã¢â‚¬Å¡Ã‚Â¬Ãƒâ€¦Ã‚Â¡ÃƒÆ’Ã¢â‚¬Å¡Ãƒâ€šÃ‚Â¬ÃƒÆ’Ã†â€™Ãƒâ€šÃ‚Â¢ÃƒÆ’Ã‚Â¢ÃƒÂ¢Ã¢â‚¬Å¡Ã‚Â¬Ãƒâ€¦Ã‚Â¾ÃƒÆ’Ã¢â‚¬Å¡Ãƒâ€šÃ‚Â¢ÃƒÆ’Ã†â€™Ãƒâ€ Ã¢â‚¬â„¢ÃƒÆ’Ã¢â‚¬Â ÃƒÂ¢Ã¢â€šÂ¬Ã¢â€žÂ¢ÃƒÆ’Ã†â€™ÃƒÂ¢Ã¢â€šÂ¬Ã‚Â ÃƒÆ’Ã‚Â¢ÃƒÂ¢Ã¢â‚¬Å¡Ã‚Â¬ÃƒÂ¢Ã¢â‚¬Å¾Ã‚Â¢ÃƒÆ’Ã†â€™Ãƒâ€ Ã¢â‚¬â„¢ÃƒÆ’Ã¢â‚¬Å¡Ãƒâ€šÃ‚Â¢ÃƒÆ’Ã†â€™Ãƒâ€šÃ‚Â¢ÃƒÆ’Ã‚Â¢ÃƒÂ¢Ã¢â‚¬Å¡Ã‚Â¬Ãƒâ€¦Ã‚Â¡ÃƒÆ’Ã¢â‚¬Å¡Ãƒâ€šÃ‚Â¬ÃƒÆ’Ã†â€™ÃƒÂ¢Ã¢â€šÂ¬Ã…Â¡ÃƒÆ’Ã¢â‚¬Å¡Ãƒâ€šÃ‚Â¦ÃƒÆ’Ã†â€™Ãƒâ€ Ã¢â‚¬â„¢ÃƒÆ’Ã¢â‚¬Â ÃƒÂ¢Ã¢â€šÂ¬Ã¢â€žÂ¢ÃƒÆ’Ã†â€™Ãƒâ€šÃ‚Â¢ÃƒÆ’Ã‚Â¢ÃƒÂ¢Ã¢â€šÂ¬Ã…Â¡Ãƒâ€šÃ‚Â¬ÃƒÆ’Ã¢â‚¬Â¦Ãƒâ€šÃ‚Â¡ÃƒÆ’Ã†â€™Ãƒâ€ Ã¢â‚¬â„¢ÃƒÆ’Ã‚Â¢ÃƒÂ¢Ã¢â‚¬Å¡Ã‚Â¬Ãƒâ€¦Ã‚Â¡ÃƒÆ’Ã†â€™ÃƒÂ¢Ã¢â€šÂ¬Ã…Â¡ÃƒÆ’Ã¢â‚¬Å¡Ãƒâ€šÃ‚Â½ÃƒÆ’Ã†â€™Ãƒâ€ Ã¢â‚¬â„¢ÃƒÆ’Ã¢â‚¬Â ÃƒÂ¢Ã¢â€šÂ¬Ã¢â€žÂ¢ÃƒÆ’Ã†â€™ÃƒÂ¢Ã¢â€šÂ¬Ã‚Â ÃƒÆ’Ã‚Â¢ÃƒÂ¢Ã¢â‚¬Å¡Ã‚Â¬ÃƒÂ¢Ã¢â‚¬Å¾Ã‚Â¢ÃƒÆ’Ã†â€™Ãƒâ€ Ã¢â‚¬â„¢ÃƒÆ’Ã‚Â¢ÃƒÂ¢Ã¢â‚¬Å¡Ã‚Â¬Ãƒâ€šÃ‚Â ÃƒÆ’Ã†â€™Ãƒâ€šÃ‚Â¢ÃƒÆ’Ã‚Â¢ÃƒÂ¢Ã¢â€šÂ¬Ã…Â¡Ãƒâ€šÃ‚Â¬ÃƒÆ’Ã‚Â¢ÃƒÂ¢Ã¢â€šÂ¬Ã…Â¾Ãƒâ€šÃ‚Â¢ÃƒÆ’Ã†â€™Ãƒâ€ Ã¢â‚¬â„¢ÃƒÆ’Ã¢â‚¬Â ÃƒÂ¢Ã¢â€šÂ¬Ã¢â€žÂ¢ÃƒÆ’Ã†â€™ÃƒÂ¢Ã¢â€šÂ¬Ã…Â¡ÃƒÆ’Ã¢â‚¬Å¡Ãƒâ€šÃ‚Â¢ÃƒÆ’Ã†â€™Ãƒâ€ Ã¢â‚¬â„¢ÃƒÆ’Ã¢â‚¬Å¡Ãƒâ€šÃ‚Â¢ÃƒÆ’Ã†â€™Ãƒâ€šÃ‚Â¢ÃƒÆ’Ã‚Â¢ÃƒÂ¢Ã¢â€šÂ¬Ã…Â¡Ãƒâ€šÃ‚Â¬ÃƒÆ’Ã¢â‚¬Â¦Ãƒâ€šÃ‚Â¡ÃƒÆ’Ã†â€™ÃƒÂ¢Ã¢â€šÂ¬Ã…Â¡ÃƒÆ’Ã¢â‚¬Å¡Ãƒâ€šÃ‚Â¬ÃƒÆ’Ã†â€™Ãƒâ€ Ã¢â‚¬â„¢ÃƒÆ’Ã‚Â¢ÃƒÂ¢Ã¢â‚¬Å¡Ã‚Â¬Ãƒâ€šÃ‚Â¦ÃƒÆ’Ã†â€™ÃƒÂ¢Ã¢â€šÂ¬Ã…Â¡ÃƒÆ’Ã¢â‚¬Å¡Ãƒâ€šÃ‚Â¡ÃƒÆ’Ã†â€™Ãƒâ€ Ã¢â‚¬â„¢ÃƒÆ’Ã¢â‚¬Â ÃƒÂ¢Ã¢â€šÂ¬Ã¢â€žÂ¢ÃƒÆ’Ã†â€™ÃƒÂ¢Ã¢â€šÂ¬Ã‚Â ÃƒÆ’Ã‚Â¢ÃƒÂ¢Ã¢â‚¬Å¡Ã‚Â¬ÃƒÂ¢Ã¢â‚¬Å¾Ã‚Â¢ÃƒÆ’Ã†â€™Ãƒâ€ Ã¢â‚¬â„¢ÃƒÆ’Ã¢â‚¬Å¡Ãƒâ€šÃ‚Â¢ÃƒÆ’Ã†â€™Ãƒâ€šÃ‚Â¢ÃƒÆ’Ã‚Â¢ÃƒÂ¢Ã¢â‚¬Å¡Ã‚Â¬Ãƒâ€¦Ã‚Â¡ÃƒÆ’Ã¢â‚¬Å¡Ãƒâ€šÃ‚Â¬ÃƒÆ’Ã†â€™ÃƒÂ¢Ã¢â€šÂ¬Ã‚Â¦ÃƒÆ’Ã¢â‚¬Å¡Ãƒâ€šÃ‚Â¡ÃƒÆ’Ã†â€™Ãƒâ€ Ã¢â‚¬â„¢ÃƒÆ’Ã¢â‚¬Â ÃƒÂ¢Ã¢â€šÂ¬Ã¢â€žÂ¢ÃƒÆ’Ã†â€™Ãƒâ€šÃ‚Â¢ÃƒÆ’Ã‚Â¢ÃƒÂ¢Ã¢â€šÂ¬Ã…Â¡Ãƒâ€šÃ‚Â¬ÃƒÆ’Ã¢â‚¬Â¦Ãƒâ€šÃ‚Â¡ÃƒÆ’Ã†â€™Ãƒâ€ Ã¢â‚¬â„¢ÃƒÆ’Ã‚Â¢ÃƒÂ¢Ã¢â‚¬Å¡Ã‚Â¬Ãƒâ€¦Ã‚Â¡ÃƒÆ’Ã†â€™ÃƒÂ¢Ã¢â€šÂ¬Ã…Â¡ÃƒÆ’Ã¢â‚¬Å¡Ãƒâ€šÃ‚Â¼g</w:t>
+        <w:t>ÃƒÆ’Ã†â€™Ãƒâ€ Ã¢â‚¬â„¢ÃƒÆ’Ã¢â‚¬Â ÃƒÂ¢Ã¢â€šÂ¬Ã¢â€žÂ¢ÃƒÆ’Ã†â€™ÃƒÂ¢Ã¢â€šÂ¬Ã‚Â ÃƒÆ’Ã‚Â¢ÃƒÂ¢Ã¢â‚¬Å¡Ã‚Â¬ÃƒÂ¢Ã¢â‚¬Å¾Ã‚Â¢ÃƒÆ’Ã†â€™Ãƒâ€ Ã¢â‚¬â„¢ÃƒÆ’Ã‚Â¢ÃƒÂ¢Ã¢â‚¬Å¡Ã‚Â¬Ãƒâ€šÃ‚Â ÃƒÆ’Ã†â€™Ãƒâ€šÃ‚Â¢ÃƒÆ’Ã‚Â¢ÃƒÂ¢Ã¢â€šÂ¬Ã…Â¡Ãƒâ€šÃ‚Â¬ÃƒÆ’Ã‚Â¢ÃƒÂ¢Ã¢â€šÂ¬Ã…Â¾Ãƒâ€šÃ‚Â¢ÃƒÆ’Ã†â€™Ãƒâ€ Ã¢â‚¬â„¢ÃƒÆ’Ã¢â‚¬Â ÃƒÂ¢Ã¢â€šÂ¬Ã¢â€žÂ¢ÃƒÆ’Ã†â€™Ãƒâ€šÃ‚Â¢ÃƒÆ’Ã‚Â¢ÃƒÂ¢Ã¢â€šÂ¬Ã…Â¡Ãƒâ€šÃ‚Â¬ÃƒÆ’Ã¢â‚¬Å¡Ãƒâ€šÃ‚Â ÃƒÆ’Ã†â€™Ãƒâ€ Ã¢â‚¬â„¢ÃƒÆ’Ã¢â‚¬Å¡Ãƒâ€šÃ‚Â¢ÃƒÆ’Ã†â€™Ãƒâ€šÃ‚Â¢ÃƒÆ’Ã‚Â¢ÃƒÂ¢Ã¢â‚¬Å¡Ã‚Â¬Ãƒâ€¦Ã‚Â¡ÃƒÆ’Ã¢â‚¬Å¡Ãƒâ€šÃ‚Â¬ÃƒÆ’Ã†â€™Ãƒâ€šÃ‚Â¢ÃƒÆ’Ã‚Â¢ÃƒÂ¢Ã¢â‚¬Å¡Ã‚Â¬Ãƒâ€¦Ã‚Â¾ÃƒÆ’Ã¢â‚¬Å¡Ãƒâ€šÃ‚Â¢ÃƒÆ’Ã†â€™Ãƒâ€ Ã¢â‚¬â„¢ÃƒÆ’Ã¢â‚¬Â ÃƒÂ¢Ã¢â€šÂ¬Ã¢â€žÂ¢ÃƒÆ’Ã†â€™ÃƒÂ¢Ã¢â€šÂ¬Ã‚Â ÃƒÆ’Ã‚Â¢ÃƒÂ¢Ã¢â‚¬Å¡Ã‚Â¬ÃƒÂ¢Ã¢â‚¬Å¾Ã‚Â¢ÃƒÆ’Ã†â€™Ãƒâ€ Ã¢â‚¬â„¢ÃƒÆ’Ã¢â‚¬Å¡Ãƒâ€šÃ‚Â¢ÃƒÆ’Ã†â€™Ãƒâ€šÃ‚Â¢ÃƒÆ’Ã‚Â¢ÃƒÂ¢Ã¢â‚¬Å¡Ã‚Â¬Ãƒâ€¦Ã‚Â¡ÃƒÆ’Ã¢â‚¬Å¡Ãƒâ€šÃ‚Â¬ÃƒÆ’Ã†â€™ÃƒÂ¢Ã¢â€šÂ¬Ã…Â¡ÃƒÆ’Ã¢â‚¬Å¡Ãƒâ€šÃ‚Â ÃƒÆ’Ã†â€™Ãƒâ€ Ã¢â‚¬â„¢ÃƒÆ’Ã¢â‚¬Â ÃƒÂ¢Ã¢â€šÂ¬Ã¢â€žÂ¢ÃƒÆ’Ã†â€™ÃƒÂ¢Ã¢â€šÂ¬Ã…Â¡ÃƒÆ’Ã¢â‚¬Å¡Ãƒâ€šÃ‚Â¢ÃƒÆ’Ã†â€™Ãƒâ€ Ã¢â‚¬â„¢ÃƒÆ’Ã¢â‚¬Å¡Ãƒâ€šÃ‚Â¢ÃƒÆ’Ã†â€™Ãƒâ€šÃ‚Â¢ÃƒÆ’Ã‚Â¢ÃƒÂ¢Ã¢â€šÂ¬Ã…Â¡Ãƒâ€šÃ‚Â¬ÃƒÆ’Ã¢â‚¬Â¦Ãƒâ€šÃ‚Â¡ÃƒÆ’Ã†â€™ÃƒÂ¢Ã¢â€šÂ¬Ã…Â¡ÃƒÆ’Ã¢â‚¬Å¡Ãƒâ€šÃ‚Â¬ÃƒÆ’Ã†â€™Ãƒâ€ Ã¢â‚¬â„¢ÃƒÆ’Ã¢â‚¬Å¡Ãƒâ€šÃ‚Â¢ÃƒÆ’Ã†â€™Ãƒâ€šÃ‚Â¢ÃƒÆ’Ã‚Â¢ÃƒÂ¢Ã¢â€šÂ¬Ã…Â¡Ãƒâ€šÃ‚Â¬ÃƒÆ’Ã¢â‚¬Â¦Ãƒâ€šÃ‚Â¾ÃƒÆ’Ã†â€™ÃƒÂ¢Ã¢â€šÂ¬Ã…Â¡ÃƒÆ’Ã¢â‚¬Å¡Ãƒâ€šÃ‚Â¢ÃƒÆ’Ã†â€™Ãƒâ€ Ã¢â‚¬â„¢ÃƒÆ’Ã¢â‚¬Â ÃƒÂ¢Ã¢â€šÂ¬Ã¢â€žÂ¢ÃƒÆ’Ã†â€™ÃƒÂ¢Ã¢â€šÂ¬Ã‚Â ÃƒÆ’Ã‚Â¢ÃƒÂ¢Ã¢â‚¬Å¡Ã‚Â¬ÃƒÂ¢Ã¢â‚¬Å¾Ã‚Â¢ÃƒÆ’Ã†â€™Ãƒâ€ Ã¢â‚¬â„¢ÃƒÆ’Ã‚Â¢ÃƒÂ¢Ã¢â‚¬Å¡Ã‚Â¬Ãƒâ€šÃ‚Â ÃƒÆ’Ã†â€™Ãƒâ€šÃ‚Â¢ÃƒÆ’Ã‚Â¢ÃƒÂ¢Ã¢â€šÂ¬Ã…Â¡Ãƒâ€šÃ‚Â¬ÃƒÆ’Ã‚Â¢ÃƒÂ¢Ã¢â€šÂ¬Ã…Â¾Ãƒâ€šÃ‚Â¢ÃƒÆ’Ã†â€™Ãƒâ€ Ã¢â‚¬â„¢ÃƒÆ’Ã¢â‚¬Â ÃƒÂ¢Ã¢â€šÂ¬Ã¢â€žÂ¢ÃƒÆ’Ã†â€™ÃƒÂ¢Ã¢â€šÂ¬Ã…Â¡ÃƒÆ’Ã¢â‚¬Å¡Ãƒâ€šÃ‚Â¢ÃƒÆ’Ã†â€™Ãƒâ€ Ã¢â‚¬â„¢ÃƒÆ’Ã¢â‚¬Å¡Ãƒâ€šÃ‚Â¢ÃƒÆ’Ã†â€™Ãƒâ€šÃ‚Â¢ÃƒÆ’Ã‚Â¢ÃƒÂ¢Ã¢â€šÂ¬Ã…Â¡Ãƒâ€šÃ‚Â¬ÃƒÆ’Ã¢â‚¬Â¦Ãƒâ€šÃ‚Â¡ÃƒÆ’Ã†â€™ÃƒÂ¢Ã¢â€šÂ¬Ã…Â¡ÃƒÆ’Ã¢â‚¬Å¡Ãƒâ€šÃ‚Â¬ÃƒÆ’Ã†â€™Ãƒâ€ Ã¢â‚¬â„¢ÃƒÆ’Ã‚Â¢ÃƒÂ¢Ã¢â‚¬Å¡Ã‚Â¬Ãƒâ€¦Ã‚Â¡ÃƒÆ’Ã†â€™ÃƒÂ¢Ã¢â€šÂ¬Ã…Â¡ÃƒÆ’Ã¢â‚¬Å¡Ãƒâ€šÃ‚Â¦ÃƒÆ’Ã†â€™Ãƒâ€ Ã¢â‚¬â„¢ÃƒÆ’Ã¢â‚¬Â ÃƒÂ¢Ã¢â€šÂ¬Ã¢â€žÂ¢ÃƒÆ’Ã†â€™ÃƒÂ¢Ã¢â€šÂ¬Ã‚Â ÃƒÆ’Ã‚Â¢ÃƒÂ¢Ã¢â‚¬Å¡Ã‚Â¬ÃƒÂ¢Ã¢â‚¬Å¾Ã‚Â¢ÃƒÆ’Ã†â€™Ãƒâ€ Ã¢â‚¬â„¢ÃƒÆ’Ã¢â‚¬Å¡Ãƒâ€šÃ‚Â¢ÃƒÆ’Ã†â€™Ãƒâ€šÃ‚Â¢ÃƒÆ’Ã‚Â¢ÃƒÂ¢Ã¢â‚¬Å¡Ã‚Â¬Ãƒâ€¦Ã‚Â¡ÃƒÆ’Ã¢â‚¬Å¡Ãƒâ€šÃ‚Â¬ÃƒÆ’Ã†â€™ÃƒÂ¢Ã¢â€šÂ¬Ã‚Â¦ÃƒÆ’Ã¢â‚¬Å¡Ãƒâ€šÃ‚Â¡ÃƒÆ’Ã†â€™Ãƒâ€ Ã¢â‚¬â„¢ÃƒÆ’Ã¢â‚¬Â ÃƒÂ¢Ã¢â€šÂ¬Ã¢â€žÂ¢ÃƒÆ’Ã†â€™Ãƒâ€šÃ‚Â¢ÃƒÆ’Ã‚Â¢ÃƒÂ¢Ã¢â€šÂ¬Ã…Â¡Ãƒâ€šÃ‚Â¬ÃƒÆ’Ã¢â‚¬Â¦Ãƒâ€šÃ‚Â¡ÃƒÆ’Ã†â€™Ãƒâ€ Ã¢â‚¬â„¢ÃƒÆ’Ã‚Â¢ÃƒÂ¢Ã¢â‚¬Å¡Ã‚Â¬Ãƒâ€¦Ã‚Â¡ÃƒÆ’Ã†â€™ÃƒÂ¢Ã¢â€šÂ¬Ã…Â¡ÃƒÆ’Ã¢â‚¬Å¡Ãƒâ€šÃ‚Â½ÃƒÆ’Ã†â€™Ãƒâ€ Ã¢â‚¬â„¢ÃƒÆ’Ã¢â‚¬Â ÃƒÂ¢Ã¢â€šÂ¬Ã¢â€žÂ¢ÃƒÆ’Ã†â€™ÃƒÂ¢Ã¢â€šÂ¬Ã‚Â ÃƒÆ’Ã‚Â¢ÃƒÂ¢Ã¢â‚¬Å¡Ã‚Â¬ÃƒÂ¢Ã¢â‚¬Å¾Ã‚Â¢ÃƒÆ’Ã†â€™Ãƒâ€ Ã¢â‚¬â„¢ÃƒÆ’Ã‚Â¢ÃƒÂ¢Ã¢â‚¬Å¡Ã‚Â¬Ãƒâ€šÃ‚Â ÃƒÆ’Ã†â€™Ãƒâ€šÃ‚Â¢ÃƒÆ’Ã‚Â¢ÃƒÂ¢Ã¢â€šÂ¬Ã…Â¡Ãƒâ€šÃ‚Â¬ÃƒÆ’Ã‚Â¢ÃƒÂ¢Ã¢â€šÂ¬Ã…Â¾Ãƒâ€šÃ‚Â¢ÃƒÆ’Ã†â€™Ãƒâ€ Ã¢â‚¬â„¢ÃƒÆ’Ã¢â‚¬Â ÃƒÂ¢Ã¢â€šÂ¬Ã¢â€žÂ¢ÃƒÆ’Ã†â€™Ãƒâ€šÃ‚Â¢ÃƒÆ’Ã‚Â¢ÃƒÂ¢Ã¢â€šÂ¬Ã…Â¡Ãƒâ€šÃ‚Â¬ÃƒÆ’Ã¢â‚¬Å¡Ãƒâ€šÃ‚Â ÃƒÆ’Ã†â€™Ãƒâ€ Ã¢â‚¬â„¢ÃƒÆ’Ã¢â‚¬Å¡Ãƒâ€šÃ‚Â¢ÃƒÆ’Ã†â€™Ãƒâ€šÃ‚Â¢ÃƒÆ’Ã‚Â¢ÃƒÂ¢Ã¢â‚¬Å¡Ã‚Â¬Ãƒâ€¦Ã‚Â¡ÃƒÆ’Ã¢â‚¬Å¡Ãƒâ€šÃ‚Â¬ÃƒÆ’Ã†â€™Ãƒâ€šÃ‚Â¢ÃƒÆ’Ã‚Â¢ÃƒÂ¢Ã¢â‚¬Å¡Ã‚Â¬Ãƒâ€¦Ã‚Â¾ÃƒÆ’Ã¢â‚¬Å¡Ãƒâ€šÃ‚Â¢ÃƒÆ’Ã†â€™Ãƒâ€ Ã¢â‚¬â„¢ÃƒÆ’Ã¢â‚¬Â ÃƒÂ¢Ã¢â€šÂ¬Ã¢â€žÂ¢ÃƒÆ’Ã†â€™ÃƒÂ¢Ã¢â€šÂ¬Ã‚Â ÃƒÆ’Ã‚Â¢ÃƒÂ¢Ã¢â‚¬Å¡Ã‚Â¬ÃƒÂ¢Ã¢â‚¬Å¾Ã‚Â¢ÃƒÆ’Ã†â€™Ãƒâ€ Ã¢â‚¬â„¢ÃƒÆ’Ã‚Â¢ÃƒÂ¢Ã¢â‚¬Å¡Ã‚Â¬Ãƒâ€¦Ã‚Â¡ÃƒÆ’Ã†â€™ÃƒÂ¢Ã¢â€šÂ¬Ã…Â¡ÃƒÆ’Ã¢â‚¬Å¡Ãƒâ€šÃ‚Â¢ÃƒÆ’Ã†â€™Ãƒâ€ Ã¢â‚¬â„¢ÃƒÆ’Ã¢â‚¬Â ÃƒÂ¢Ã¢â€šÂ¬Ã¢â€žÂ¢ÃƒÆ’Ã†â€™ÃƒÂ¢Ã¢â€šÂ¬Ã…Â¡ÃƒÆ’Ã¢â‚¬Å¡Ãƒâ€šÃ‚Â¢ÃƒÆ’Ã†â€™Ãƒâ€ Ã¢â‚¬â„¢ÃƒÆ’Ã¢â‚¬Å¡Ãƒâ€šÃ‚Â¢ÃƒÆ’Ã†â€™Ãƒâ€šÃ‚Â¢ÃƒÆ’Ã‚Â¢ÃƒÂ¢Ã¢â‚¬Å¡Ã‚Â¬Ãƒâ€¦Ã‚Â¡ÃƒÆ’Ã¢â‚¬Å¡Ãƒâ€šÃ‚Â¬ÃƒÆ’Ã†â€™ÃƒÂ¢Ã¢â€šÂ¬Ã‚Â¦ÃƒÆ’Ã¢â‚¬Å¡Ãƒâ€šÃ‚Â¡ÃƒÆ’Ã†â€™Ãƒâ€ Ã¢â‚¬â„¢ÃƒÆ’Ã‚Â¢ÃƒÂ¢Ã¢â‚¬Å¡Ã‚Â¬Ãƒâ€¦Ã‚Â¡ÃƒÆ’Ã†â€™ÃƒÂ¢Ã¢â€šÂ¬Ã…Â¡ÃƒÆ’Ã¢â‚¬Å¡Ãƒâ€šÃ‚Â¬ÃƒÆ’Ã†â€™Ãƒâ€ Ã¢â‚¬â„¢ÃƒÆ’Ã¢â‚¬Â ÃƒÂ¢Ã¢â€šÂ¬Ã¢â€žÂ¢ÃƒÆ’Ã†â€™Ãƒâ€šÃ‚Â¢ÃƒÆ’Ã‚Â¢ÃƒÂ¢Ã¢â€šÂ¬Ã…Â¡Ãƒâ€šÃ‚Â¬ÃƒÆ’Ã¢â‚¬Å¡Ãƒâ€šÃ‚Â¦ÃƒÆ’Ã†â€™Ãƒâ€ Ã¢â‚¬â„¢ÃƒÆ’Ã‚Â¢ÃƒÂ¢Ã¢â‚¬Å¡Ã‚Â¬Ãƒâ€¦Ã‚Â¡ÃƒÆ’Ã†â€™ÃƒÂ¢Ã¢â€šÂ¬Ã…Â¡ÃƒÆ’Ã¢â‚¬Å¡Ãƒâ€šÃ‚Â¡ÃƒÆ’Ã†â€™Ãƒâ€ Ã¢â‚¬â„¢ÃƒÆ’Ã¢â‚¬Â ÃƒÂ¢Ã¢â€šÂ¬Ã¢â€žÂ¢ÃƒÆ’Ã†â€™ÃƒÂ¢Ã¢â€šÂ¬Ã‚Â ÃƒÆ’Ã‚Â¢ÃƒÂ¢Ã¢â‚¬Å¡Ã‚Â¬ÃƒÂ¢Ã¢â‚¬Å¾Ã‚Â¢ÃƒÆ’Ã†â€™Ãƒâ€ Ã¢â‚¬â„¢ÃƒÆ’Ã‚Â¢ÃƒÂ¢Ã¢â‚¬Å¡Ã‚Â¬Ãƒâ€šÃ‚Â ÃƒÆ’Ã†â€™Ãƒâ€šÃ‚Â¢ÃƒÆ’Ã‚Â¢ÃƒÂ¢Ã¢â€šÂ¬Ã…Â¡Ãƒâ€šÃ‚Â¬ÃƒÆ’Ã‚Â¢ÃƒÂ¢Ã¢â€šÂ¬Ã…Â¾Ãƒâ€šÃ‚Â¢ÃƒÆ’Ã†â€™Ãƒâ€ Ã¢â‚¬â„¢ÃƒÆ’Ã¢â‚¬Â ÃƒÂ¢Ã¢â€šÂ¬Ã¢â€žÂ¢ÃƒÆ’Ã†â€™ÃƒÂ¢Ã¢â€šÂ¬Ã…Â¡ÃƒÆ’Ã¢â‚¬Å¡Ãƒâ€šÃ‚Â¢ÃƒÆ’Ã†â€™Ãƒâ€ Ã¢â‚¬â„¢ÃƒÆ’Ã¢â‚¬Å¡Ãƒâ€šÃ‚Â¢ÃƒÆ’Ã†â€™Ãƒâ€šÃ‚Â¢ÃƒÆ’Ã‚Â¢ÃƒÂ¢Ã¢â€šÂ¬Ã…Â¡Ãƒâ€šÃ‚Â¬ÃƒÆ’Ã¢â‚¬Â¦Ãƒâ€šÃ‚Â¡ÃƒÆ’Ã†â€™ÃƒÂ¢Ã¢â€šÂ¬Ã…Â¡ÃƒÆ’Ã¢â‚¬Å¡Ãƒâ€šÃ‚Â¬ÃƒÆ’Ã†â€™Ãƒâ€ Ã¢â‚¬â„¢ÃƒÆ’Ã‚Â¢ÃƒÂ¢Ã¢â‚¬Å¡Ã‚Â¬Ãƒâ€šÃ‚Â¦ÃƒÆ’Ã†â€™ÃƒÂ¢Ã¢â€šÂ¬Ã…Â¡ÃƒÆ’Ã¢â‚¬Å¡Ãƒâ€šÃ‚Â¡ÃƒÆ’Ã†â€™Ãƒâ€ Ã¢â‚¬â„¢ÃƒÆ’Ã¢â‚¬Â ÃƒÂ¢Ã¢â€šÂ¬Ã¢â€žÂ¢ÃƒÆ’Ã†â€™ÃƒÂ¢Ã¢â€šÂ¬Ã‚Â ÃƒÆ’Ã‚Â¢ÃƒÂ¢Ã¢â‚¬Å¡Ã‚Â¬ÃƒÂ¢Ã¢â‚¬Å¾Ã‚Â¢ÃƒÆ’Ã†â€™Ãƒâ€ Ã¢â‚¬â„¢ÃƒÆ’Ã¢â‚¬Å¡Ãƒâ€šÃ‚Â¢ÃƒÆ’Ã†â€™Ãƒâ€šÃ‚Â¢ÃƒÆ’Ã‚Â¢ÃƒÂ¢Ã¢â‚¬Å¡Ã‚Â¬Ãƒâ€¦Ã‚Â¡ÃƒÆ’Ã¢â‚¬Å¡Ãƒâ€šÃ‚Â¬ÃƒÆ’Ã†â€™ÃƒÂ¢Ã¢â€šÂ¬Ã‚Â¦ÃƒÆ’Ã¢â‚¬Å¡Ãƒâ€šÃ‚Â¡ÃƒÆ’Ã†â€™Ãƒâ€ Ã¢â‚¬â„¢ÃƒÆ’Ã¢â‚¬Â ÃƒÂ¢Ã¢â€šÂ¬Ã¢â€žÂ¢ÃƒÆ’Ã†â€™Ãƒâ€šÃ‚Â¢ÃƒÆ’Ã‚Â¢ÃƒÂ¢Ã¢â€šÂ¬Ã…Â¡Ãƒâ€šÃ‚Â¬ÃƒÆ’Ã¢â‚¬Â¦Ãƒâ€šÃ‚Â¡ÃƒÆ’Ã†â€™Ãƒâ€ Ã¢â‚¬â„¢ÃƒÆ’Ã‚Â¢ÃƒÂ¢Ã¢â‚¬Å¡Ã‚Â¬Ãƒâ€¦Ã‚Â¡ÃƒÆ’Ã†â€™ÃƒÂ¢Ã¢â€šÂ¬Ã…Â¡ÃƒÆ’Ã¢â‚¬Å¡Ãƒâ€šÃ‚Â¼g</w:t>
       </w:r>
       <w:proofErr w:type="spellEnd"/>
       <w:r>
@@ -8914,7 +8914,7 @@
           <w:sz w:val="28"/>
           <w:szCs w:val="28"/>
         </w:rPr>
-        <w:t>ÃƒÆ’Ã†â€™Ãƒâ€ Ã¢â‚¬â„¢ÃƒÆ’Ã¢â‚¬Â ÃƒÂ¢Ã¢â€šÂ¬Ã¢â€žÂ¢ÃƒÆ’Ã†â€™ÃƒÂ¢Ã¢â€šÂ¬Ã‚Â ÃƒÆ’Ã‚Â¢ÃƒÂ¢Ã¢â‚¬Å¡Ã‚Â¬ÃƒÂ¢Ã¢â‚¬Å¾Ã‚Â¢ÃƒÆ’Ã†â€™Ãƒâ€ Ã¢â‚¬â„¢ÃƒÆ’Ã‚Â¢ÃƒÂ¢Ã¢â‚¬Å¡Ã‚Â¬Ãƒâ€šÃ‚Â ÃƒÆ’Ã†â€™Ãƒâ€šÃ‚Â¢ÃƒÆ’Ã‚Â¢ÃƒÂ¢Ã¢â€šÂ¬Ã…Â¡Ãƒâ€šÃ‚Â¬ÃƒÆ’Ã‚Â¢ÃƒÂ¢Ã¢â€šÂ¬Ã…Â¾Ãƒâ€šÃ‚Â¢ÃƒÆ’Ã†â€™Ãƒâ€ Ã¢â‚¬â„¢ÃƒÆ’Ã¢â‚¬Â ÃƒÂ¢Ã¢â€šÂ¬Ã¢â€žÂ¢ÃƒÆ’Ã†â€™Ãƒâ€šÃ‚Â¢ÃƒÆ’Ã‚Â¢ÃƒÂ¢Ã¢â€šÂ¬Ã…Â¡Ãƒâ€šÃ‚Â¬ÃƒÆ’Ã¢â‚¬Å¡Ãƒâ€šÃ‚Â ÃƒÆ’Ã†â€™Ãƒâ€ Ã¢â‚¬â„¢ÃƒÆ’Ã¢â‚¬Å¡Ãƒâ€šÃ‚Â¢ÃƒÆ’Ã†â€™Ãƒâ€šÃ‚Â¢ÃƒÆ’Ã‚Â¢ÃƒÂ¢Ã¢â‚¬Å¡Ã‚Â¬Ãƒâ€¦Ã‚Â¡ÃƒÆ’Ã¢â‚¬Å¡Ãƒâ€šÃ‚Â¬ÃƒÆ’Ã†â€™Ãƒâ€šÃ‚Â¢ÃƒÆ’Ã‚Â¢ÃƒÂ¢Ã¢â‚¬Å¡Ã‚Â¬Ãƒâ€¦Ã‚Â¾ÃƒÆ’Ã¢â‚¬Å¡Ãƒâ€šÃ‚Â¢ÃƒÆ’Ã†â€™Ãƒâ€ Ã¢â‚¬â„¢ÃƒÆ’Ã¢â‚¬Â ÃƒÂ¢Ã¢â€šÂ¬Ã¢â€žÂ¢ÃƒÆ’Ã†â€™ÃƒÂ¢Ã¢â€šÂ¬Ã‚Â ÃƒÆ’Ã‚Â¢ÃƒÂ¢Ã¢â‚¬Å¡Ã‚Â¬ÃƒÂ¢Ã¢â‚¬Å¾Ã‚Â¢ÃƒÆ’Ã†â€™Ãƒâ€ Ã¢â‚¬â„¢ÃƒÆ’Ã¢â‚¬Å¡Ãƒâ€šÃ‚Â¢ÃƒÆ’Ã†â€™Ãƒâ€šÃ‚Â¢ÃƒÆ’Ã‚Â¢ÃƒÂ¢Ã¢â‚¬Å¡Ã‚Â¬Ãƒâ€¦Ã‚Â¡ÃƒÆ’Ã¢â‚¬Å¡Ãƒâ€šÃ‚Â¬ÃƒÆ’Ã†â€™ÃƒÂ¢Ã¢â€šÂ¬Ã…Â¡ÃƒÆ’Ã¢â‚¬Å¡Ãƒâ€šÃ‚Â¦ÃƒÆ’Ã†â€™Ãƒâ€ Ã¢â‚¬â„¢ÃƒÆ’Ã¢â‚¬Â ÃƒÂ¢Ã¢â€šÂ¬Ã¢â€žÂ¢ÃƒÆ’Ã†â€™Ãƒâ€šÃ‚Â¢ÃƒÆ’Ã‚Â¢ÃƒÂ¢Ã¢â€šÂ¬Ã…Â¡Ãƒâ€šÃ‚Â¬ÃƒÆ’Ã¢â‚¬Â¦Ãƒâ€šÃ‚Â¡ÃƒÆ’Ã†â€™Ãƒâ€ Ã¢â‚¬â„¢ÃƒÆ’Ã‚Â¢ÃƒÂ¢Ã¢â‚¬Å¡Ã‚Â¬Ãƒâ€¦Ã‚Â¡ÃƒÆ’Ã†â€™ÃƒÂ¢Ã¢â€šÂ¬Ã…Â¡ÃƒÆ’Ã¢â‚¬Å¡Ãƒâ€šÃ‚Â½ÃƒÆ’Ã†â€™Ãƒâ€ Ã¢â‚¬â„¢ÃƒÆ’Ã¢â‚¬Â ÃƒÂ¢Ã¢â€šÂ¬Ã¢â€žÂ¢ÃƒÆ’Ã†â€™ÃƒÂ¢Ã¢â€šÂ¬Ã‚Â ÃƒÆ’Ã‚Â¢ÃƒÂ¢Ã¢â‚¬Å¡Ã‚Â¬ÃƒÂ¢Ã¢â‚¬Å¾Ã‚Â¢ÃƒÆ’Ã†â€™Ãƒâ€ Ã¢â‚¬â„¢ÃƒÆ’Ã‚Â¢ÃƒÂ¢Ã¢â‚¬Å¡Ã‚Â¬Ãƒâ€šÃ‚Â ÃƒÆ’Ã†â€™Ãƒâ€šÃ‚Â¢ÃƒÆ’Ã‚Â¢ÃƒÂ¢Ã¢â€šÂ¬Ã…Â¡Ãƒâ€šÃ‚Â¬ÃƒÆ’Ã‚Â¢ÃƒÂ¢Ã¢â€šÂ¬Ã…Â¾Ãƒâ€šÃ‚Â¢ÃƒÆ’Ã†â€™Ãƒâ€ Ã¢â‚¬â„¢ÃƒÆ’Ã¢â‚¬Â ÃƒÂ¢Ã¢â€šÂ¬Ã¢â€žÂ¢ÃƒÆ’Ã†â€™ÃƒÂ¢Ã¢â€šÂ¬Ã…Â¡ÃƒÆ’Ã¢â‚¬Å¡Ãƒâ€šÃ‚Â¢ÃƒÆ’Ã†â€™Ãƒâ€ Ã¢â‚¬â„¢ÃƒÆ’Ã¢â‚¬Å¡Ãƒâ€šÃ‚Â¢ÃƒÆ’Ã†â€™Ãƒâ€šÃ‚Â¢ÃƒÆ’Ã‚Â¢ÃƒÂ¢Ã¢â€šÂ¬Ã…Â¡Ãƒâ€šÃ‚Â¬ÃƒÆ’Ã¢â‚¬Â¦Ãƒâ€šÃ‚Â¡ÃƒÆ’Ã†â€™ÃƒÂ¢Ã¢â€šÂ¬Ã…Â¡ÃƒÆ’Ã¢â‚¬Å¡Ãƒâ€šÃ‚Â¬ÃƒÆ’Ã†â€™Ãƒâ€ Ã¢â‚¬â„¢ÃƒÆ’Ã‚Â¢ÃƒÂ¢Ã¢â‚¬Å¡Ã‚Â¬Ãƒâ€šÃ‚Â¦ÃƒÆ’Ã†â€™ÃƒÂ¢Ã¢â€šÂ¬Ã…Â¡ÃƒÆ’Ã¢â‚¬Å¡Ãƒâ€šÃ‚Â¡ÃƒÆ’Ã†â€™Ãƒâ€ Ã¢â‚¬â„¢ÃƒÆ’Ã¢â‚¬Â ÃƒÂ¢Ã¢â€šÂ¬Ã¢â€žÂ¢ÃƒÆ’Ã†â€™ÃƒÂ¢Ã¢â€šÂ¬Ã‚Â ÃƒÆ’Ã‚Â¢ÃƒÂ¢Ã¢â‚¬Å¡Ã‚Â¬ÃƒÂ¢Ã¢â‚¬Å¾Ã‚Â¢ÃƒÆ’Ã†â€™Ãƒâ€ Ã¢â‚¬â„¢ÃƒÆ’Ã¢â‚¬Å¡Ãƒâ€šÃ‚Â¢ÃƒÆ’Ã†â€™Ãƒâ€šÃ‚Â¢ÃƒÆ’Ã‚Â¢ÃƒÂ¢Ã¢â‚¬Å¡Ã‚Â¬Ãƒâ€¦Ã‚Â¡ÃƒÆ’Ã¢â‚¬Å¡Ãƒâ€šÃ‚Â¬ÃƒÆ’Ã†â€™ÃƒÂ¢Ã¢â€šÂ¬Ã‚Â¦ÃƒÆ’Ã¢â‚¬Å¡Ãƒâ€šÃ‚Â¡ÃƒÆ’Ã†â€™Ãƒâ€ Ã¢â‚¬â„¢ÃƒÆ’Ã¢â‚¬Â ÃƒÂ¢Ã¢â€šÂ¬Ã¢â€žÂ¢ÃƒÆ’Ã†â€™Ãƒâ€šÃ‚Â¢ÃƒÆ’Ã‚Â¢ÃƒÂ¢Ã¢â€šÂ¬Ã…Â¡Ãƒâ€šÃ‚Â¬ÃƒÆ’Ã¢â‚¬Â¦Ãƒâ€šÃ‚Â¡ÃƒÆ’Ã†â€™Ãƒâ€ Ã¢â‚¬â„¢ÃƒÆ’Ã‚Â¢ÃƒÂ¢Ã¢â‚¬Å¡Ã‚Â¬Ãƒâ€¦Ã‚Â¡ÃƒÆ’Ã†â€™ÃƒÂ¢Ã¢â€šÂ¬Ã…Â¡ÃƒÆ’Ã¢â‚¬Å¡Ãƒâ€šÃ‚Â¼g</w:t>
+        <w:t>ÃƒÆ’Ã†â€™Ãƒâ€ Ã¢â‚¬â„¢ÃƒÆ’Ã¢â‚¬Â ÃƒÂ¢Ã¢â€šÂ¬Ã¢â€žÂ¢ÃƒÆ’Ã†â€™ÃƒÂ¢Ã¢â€šÂ¬Ã‚Â ÃƒÆ’Ã‚Â¢ÃƒÂ¢Ã¢â‚¬Å¡Ã‚Â¬ÃƒÂ¢Ã¢â‚¬Å¾Ã‚Â¢ÃƒÆ’Ã†â€™Ãƒâ€ Ã¢â‚¬â„¢ÃƒÆ’Ã‚Â¢ÃƒÂ¢Ã¢â‚¬Å¡Ã‚Â¬Ãƒâ€šÃ‚Â ÃƒÆ’Ã†â€™Ãƒâ€šÃ‚Â¢ÃƒÆ’Ã‚Â¢ÃƒÂ¢Ã¢â€šÂ¬Ã…Â¡Ãƒâ€šÃ‚Â¬ÃƒÆ’Ã‚Â¢ÃƒÂ¢Ã¢â€šÂ¬Ã…Â¾Ãƒâ€šÃ‚Â¢ÃƒÆ’Ã†â€™Ãƒâ€ Ã¢â‚¬â„¢ÃƒÆ’Ã¢â‚¬Â ÃƒÂ¢Ã¢â€šÂ¬Ã¢â€žÂ¢ÃƒÆ’Ã†â€™Ãƒâ€šÃ‚Â¢ÃƒÆ’Ã‚Â¢ÃƒÂ¢Ã¢â€šÂ¬Ã…Â¡Ãƒâ€šÃ‚Â¬ÃƒÆ’Ã¢â‚¬Å¡Ãƒâ€šÃ‚Â ÃƒÆ’Ã†â€™Ãƒâ€ Ã¢â‚¬â„¢ÃƒÆ’Ã¢â‚¬Å¡Ãƒâ€šÃ‚Â¢ÃƒÆ’Ã†â€™Ãƒâ€šÃ‚Â¢ÃƒÆ’Ã‚Â¢ÃƒÂ¢Ã¢â‚¬Å¡Ã‚Â¬Ãƒâ€¦Ã‚Â¡ÃƒÆ’Ã¢â‚¬Å¡Ãƒâ€šÃ‚Â¬ÃƒÆ’Ã†â€™Ãƒâ€šÃ‚Â¢ÃƒÆ’Ã‚Â¢ÃƒÂ¢Ã¢â‚¬Å¡Ã‚Â¬Ãƒâ€¦Ã‚Â¾ÃƒÆ’Ã¢â‚¬Å¡Ãƒâ€šÃ‚Â¢ÃƒÆ’Ã†â€™Ãƒâ€ Ã¢â‚¬â„¢ÃƒÆ’Ã¢â‚¬Â ÃƒÂ¢Ã¢â€šÂ¬Ã¢â€žÂ¢ÃƒÆ’Ã†â€™ÃƒÂ¢Ã¢â€šÂ¬Ã‚Â ÃƒÆ’Ã‚Â¢ÃƒÂ¢Ã¢â‚¬Å¡Ã‚Â¬ÃƒÂ¢Ã¢â‚¬Å¾Ã‚Â¢ÃƒÆ’Ã†â€™Ãƒâ€ Ã¢â‚¬â„¢ÃƒÆ’Ã¢â‚¬Å¡Ãƒâ€šÃ‚Â¢ÃƒÆ’Ã†â€™Ãƒâ€šÃ‚Â¢ÃƒÆ’Ã‚Â¢ÃƒÂ¢Ã¢â‚¬Å¡Ã‚Â¬Ãƒâ€¦Ã‚Â¡ÃƒÆ’Ã¢â‚¬Å¡Ãƒâ€šÃ‚Â¬ÃƒÆ’Ã†â€™ÃƒÂ¢Ã¢â€šÂ¬Ã…Â¡ÃƒÆ’Ã¢â‚¬Å¡Ãƒâ€šÃ‚Â ÃƒÆ’Ã†â€™Ãƒâ€ Ã¢â‚¬â„¢ÃƒÆ’Ã¢â‚¬Â ÃƒÂ¢Ã¢â€šÂ¬Ã¢â€žÂ¢ÃƒÆ’Ã†â€™ÃƒÂ¢Ã¢â€šÂ¬Ã…Â¡ÃƒÆ’Ã¢â‚¬Å¡Ãƒâ€šÃ‚Â¢ÃƒÆ’Ã†â€™Ãƒâ€ Ã¢â‚¬â„¢ÃƒÆ’Ã¢â‚¬Å¡Ãƒâ€šÃ‚Â¢ÃƒÆ’Ã†â€™Ãƒâ€šÃ‚Â¢ÃƒÆ’Ã‚Â¢ÃƒÂ¢Ã¢â€šÂ¬Ã…Â¡Ãƒâ€šÃ‚Â¬ÃƒÆ’Ã¢â‚¬Â¦Ãƒâ€šÃ‚Â¡ÃƒÆ’Ã†â€™ÃƒÂ¢Ã¢â€šÂ¬Ã…Â¡ÃƒÆ’Ã¢â‚¬Å¡Ãƒâ€šÃ‚Â¬ÃƒÆ’Ã†â€™Ãƒâ€ Ã¢â‚¬â„¢ÃƒÆ’Ã¢â‚¬Å¡Ãƒâ€šÃ‚Â¢ÃƒÆ’Ã†â€™Ãƒâ€šÃ‚Â¢ÃƒÆ’Ã‚Â¢ÃƒÂ¢Ã¢â€šÂ¬Ã…Â¡Ãƒâ€šÃ‚Â¬ÃƒÆ’Ã¢â‚¬Â¦Ãƒâ€šÃ‚Â¾ÃƒÆ’Ã†â€™ÃƒÂ¢Ã¢â€šÂ¬Ã…Â¡ÃƒÆ’Ã¢â‚¬Å¡Ãƒâ€šÃ‚Â¢ÃƒÆ’Ã†â€™Ãƒâ€ Ã¢â‚¬â„¢ÃƒÆ’Ã¢â‚¬Â ÃƒÂ¢Ã¢â€šÂ¬Ã¢â€žÂ¢ÃƒÆ’Ã†â€™ÃƒÂ¢Ã¢â€šÂ¬Ã‚Â ÃƒÆ’Ã‚Â¢ÃƒÂ¢Ã¢â‚¬Å¡Ã‚Â¬ÃƒÂ¢Ã¢â‚¬Å¾Ã‚Â¢ÃƒÆ’Ã†â€™Ãƒâ€ Ã¢â‚¬â„¢ÃƒÆ’Ã‚Â¢ÃƒÂ¢Ã¢â‚¬Å¡Ã‚Â¬Ãƒâ€šÃ‚Â ÃƒÆ’Ã†â€™Ãƒâ€šÃ‚Â¢ÃƒÆ’Ã‚Â¢ÃƒÂ¢Ã¢â€šÂ¬Ã…Â¡Ãƒâ€šÃ‚Â¬ÃƒÆ’Ã‚Â¢ÃƒÂ¢Ã¢â€šÂ¬Ã…Â¾Ãƒâ€šÃ‚Â¢ÃƒÆ’Ã†â€™Ãƒâ€ Ã¢â‚¬â„¢ÃƒÆ’Ã¢â‚¬Â ÃƒÂ¢Ã¢â€šÂ¬Ã¢â€žÂ¢ÃƒÆ’Ã†â€™ÃƒÂ¢Ã¢â€šÂ¬Ã…Â¡ÃƒÆ’Ã¢â‚¬Å¡Ãƒâ€šÃ‚Â¢ÃƒÆ’Ã†â€™Ãƒâ€ Ã¢â‚¬â„¢ÃƒÆ’Ã¢â‚¬Å¡Ãƒâ€šÃ‚Â¢ÃƒÆ’Ã†â€™Ãƒâ€šÃ‚Â¢ÃƒÆ’Ã‚Â¢ÃƒÂ¢Ã¢â€šÂ¬Ã…Â¡Ãƒâ€šÃ‚Â¬ÃƒÆ’Ã¢â‚¬Â¦Ãƒâ€šÃ‚Â¡ÃƒÆ’Ã†â€™ÃƒÂ¢Ã¢â€šÂ¬Ã…Â¡ÃƒÆ’Ã¢â‚¬Å¡Ãƒâ€šÃ‚Â¬ÃƒÆ’Ã†â€™Ãƒâ€ Ã¢â‚¬â„¢ÃƒÆ’Ã‚Â¢ÃƒÂ¢Ã¢â‚¬Å¡Ã‚Â¬Ãƒâ€¦Ã‚Â¡ÃƒÆ’Ã†â€™ÃƒÂ¢Ã¢â€šÂ¬Ã…Â¡ÃƒÆ’Ã¢â‚¬Å¡Ãƒâ€šÃ‚Â¦ÃƒÆ’Ã†â€™Ãƒâ€ Ã¢â‚¬â„¢ÃƒÆ’Ã¢â‚¬Â ÃƒÂ¢Ã¢â€šÂ¬Ã¢â€žÂ¢ÃƒÆ’Ã†â€™ÃƒÂ¢Ã¢â€šÂ¬Ã‚Â ÃƒÆ’Ã‚Â¢ÃƒÂ¢Ã¢â‚¬Å¡Ã‚Â¬ÃƒÂ¢Ã¢â‚¬Å¾Ã‚Â¢ÃƒÆ’Ã†â€™Ãƒâ€ Ã¢â‚¬â„¢ÃƒÆ’Ã¢â‚¬Å¡Ãƒâ€šÃ‚Â¢ÃƒÆ’Ã†â€™Ãƒâ€šÃ‚Â¢ÃƒÆ’Ã‚Â¢ÃƒÂ¢Ã¢â‚¬Å¡Ã‚Â¬Ãƒâ€¦Ã‚Â¡ÃƒÆ’Ã¢â‚¬Å¡Ãƒâ€šÃ‚Â¬ÃƒÆ’Ã†â€™ÃƒÂ¢Ã¢â€šÂ¬Ã‚Â¦ÃƒÆ’Ã¢â‚¬Å¡Ãƒâ€šÃ‚Â¡ÃƒÆ’Ã†â€™Ãƒâ€ Ã¢â‚¬â„¢ÃƒÆ’Ã¢â‚¬Â ÃƒÂ¢Ã¢â€šÂ¬Ã¢â€žÂ¢ÃƒÆ’Ã†â€™Ãƒâ€šÃ‚Â¢ÃƒÆ’Ã‚Â¢ÃƒÂ¢Ã¢â€šÂ¬Ã…Â¡Ãƒâ€šÃ‚Â¬ÃƒÆ’Ã¢â‚¬Â¦Ãƒâ€šÃ‚Â¡ÃƒÆ’Ã†â€™Ãƒâ€ Ã¢â‚¬â„¢ÃƒÆ’Ã‚Â¢ÃƒÂ¢Ã¢â‚¬Å¡Ã‚Â¬Ãƒâ€¦Ã‚Â¡ÃƒÆ’Ã†â€™ÃƒÂ¢Ã¢â€šÂ¬Ã…Â¡ÃƒÆ’Ã¢â‚¬Å¡Ãƒâ€šÃ‚Â½ÃƒÆ’Ã†â€™Ãƒâ€ Ã¢â‚¬â„¢ÃƒÆ’Ã¢â‚¬Â ÃƒÂ¢Ã¢â€šÂ¬Ã¢â€žÂ¢ÃƒÆ’Ã†â€™ÃƒÂ¢Ã¢â€šÂ¬Ã‚Â ÃƒÆ’Ã‚Â¢ÃƒÂ¢Ã¢â‚¬Å¡Ã‚Â¬ÃƒÂ¢Ã¢â‚¬Å¾Ã‚Â¢ÃƒÆ’Ã†â€™Ãƒâ€ Ã¢â‚¬â„¢ÃƒÆ’Ã‚Â¢ÃƒÂ¢Ã¢â‚¬Å¡Ã‚Â¬Ãƒâ€šÃ‚Â ÃƒÆ’Ã†â€™Ãƒâ€šÃ‚Â¢ÃƒÆ’Ã‚Â¢ÃƒÂ¢Ã¢â€šÂ¬Ã…Â¡Ãƒâ€šÃ‚Â¬ÃƒÆ’Ã‚Â¢ÃƒÂ¢Ã¢â€šÂ¬Ã…Â¾Ãƒâ€šÃ‚Â¢ÃƒÆ’Ã†â€™Ãƒâ€ Ã¢â‚¬â„¢ÃƒÆ’Ã¢â‚¬Â ÃƒÂ¢Ã¢â€šÂ¬Ã¢â€žÂ¢ÃƒÆ’Ã†â€™Ãƒâ€šÃ‚Â¢ÃƒÆ’Ã‚Â¢ÃƒÂ¢Ã¢â€šÂ¬Ã…Â¡Ãƒâ€šÃ‚Â¬ÃƒÆ’Ã¢â‚¬Å¡Ãƒâ€šÃ‚Â ÃƒÆ’Ã†â€™Ãƒâ€ Ã¢â‚¬â„¢ÃƒÆ’Ã¢â‚¬Å¡Ãƒâ€šÃ‚Â¢ÃƒÆ’Ã†â€™Ãƒâ€šÃ‚Â¢ÃƒÆ’Ã‚Â¢ÃƒÂ¢Ã¢â‚¬Å¡Ã‚Â¬Ãƒâ€¦Ã‚Â¡ÃƒÆ’Ã¢â‚¬Å¡Ãƒâ€šÃ‚Â¬ÃƒÆ’Ã†â€™Ãƒâ€šÃ‚Â¢ÃƒÆ’Ã‚Â¢ÃƒÂ¢Ã¢â‚¬Å¡Ã‚Â¬Ãƒâ€¦Ã‚Â¾ÃƒÆ’Ã¢â‚¬Å¡Ãƒâ€šÃ‚Â¢ÃƒÆ’Ã†â€™Ãƒâ€ Ã¢â‚¬â„¢ÃƒÆ’Ã¢â‚¬Â ÃƒÂ¢Ã¢â€šÂ¬Ã¢â€žÂ¢ÃƒÆ’Ã†â€™ÃƒÂ¢Ã¢â€šÂ¬Ã‚Â ÃƒÆ’Ã‚Â¢ÃƒÂ¢Ã¢â‚¬Å¡Ã‚Â¬ÃƒÂ¢Ã¢â‚¬Å¾Ã‚Â¢ÃƒÆ’Ã†â€™Ãƒâ€ Ã¢â‚¬â„¢ÃƒÆ’Ã‚Â¢ÃƒÂ¢Ã¢â‚¬Å¡Ã‚Â¬Ãƒâ€¦Ã‚Â¡ÃƒÆ’Ã†â€™ÃƒÂ¢Ã¢â€šÂ¬Ã…Â¡ÃƒÆ’Ã¢â‚¬Å¡Ãƒâ€šÃ‚Â¢ÃƒÆ’Ã†â€™Ãƒâ€ Ã¢â‚¬â„¢ÃƒÆ’Ã¢â‚¬Â ÃƒÂ¢Ã¢â€šÂ¬Ã¢â€žÂ¢ÃƒÆ’Ã†â€™ÃƒÂ¢Ã¢â€šÂ¬Ã…Â¡ÃƒÆ’Ã¢â‚¬Å¡Ãƒâ€šÃ‚Â¢ÃƒÆ’Ã†â€™Ãƒâ€ Ã¢â‚¬â„¢ÃƒÆ’Ã¢â‚¬Å¡Ãƒâ€šÃ‚Â¢ÃƒÆ’Ã†â€™Ãƒâ€šÃ‚Â¢ÃƒÆ’Ã‚Â¢ÃƒÂ¢Ã¢â‚¬Å¡Ã‚Â¬Ãƒâ€¦Ã‚Â¡ÃƒÆ’Ã¢â‚¬Å¡Ãƒâ€šÃ‚Â¬ÃƒÆ’Ã†â€™ÃƒÂ¢Ã¢â€šÂ¬Ã‚Â¦ÃƒÆ’Ã¢â‚¬Å¡Ãƒâ€šÃ‚Â¡ÃƒÆ’Ã†â€™Ãƒâ€ Ã¢â‚¬â„¢ÃƒÆ’Ã‚Â¢ÃƒÂ¢Ã¢â‚¬Å¡Ã‚Â¬Ãƒâ€¦Ã‚Â¡ÃƒÆ’Ã†â€™ÃƒÂ¢Ã¢â€šÂ¬Ã…Â¡ÃƒÆ’Ã¢â‚¬Å¡Ãƒâ€šÃ‚Â¬ÃƒÆ’Ã†â€™Ãƒâ€ Ã¢â‚¬â„¢ÃƒÆ’Ã¢â‚¬Â ÃƒÂ¢Ã¢â€šÂ¬Ã¢â€žÂ¢ÃƒÆ’Ã†â€™Ãƒâ€šÃ‚Â¢ÃƒÆ’Ã‚Â¢ÃƒÂ¢Ã¢â€šÂ¬Ã…Â¡Ãƒâ€šÃ‚Â¬ÃƒÆ’Ã¢â‚¬Å¡Ãƒâ€šÃ‚Â¦ÃƒÆ’Ã†â€™Ãƒâ€ Ã¢â‚¬â„¢ÃƒÆ’Ã‚Â¢ÃƒÂ¢Ã¢â‚¬Å¡Ã‚Â¬Ãƒâ€¦Ã‚Â¡ÃƒÆ’Ã†â€™ÃƒÂ¢Ã¢â€šÂ¬Ã…Â¡ÃƒÆ’Ã¢â‚¬Å¡Ãƒâ€šÃ‚Â¡ÃƒÆ’Ã†â€™Ãƒâ€ Ã¢â‚¬â„¢ÃƒÆ’Ã¢â‚¬Â ÃƒÂ¢Ã¢â€šÂ¬Ã¢â€žÂ¢ÃƒÆ’Ã†â€™ÃƒÂ¢Ã¢â€šÂ¬Ã‚Â ÃƒÆ’Ã‚Â¢ÃƒÂ¢Ã¢â‚¬Å¡Ã‚Â¬ÃƒÂ¢Ã¢â‚¬Å¾Ã‚Â¢ÃƒÆ’Ã†â€™Ãƒâ€ Ã¢â‚¬â„¢ÃƒÆ’Ã‚Â¢ÃƒÂ¢Ã¢â‚¬Å¡Ã‚Â¬Ãƒâ€šÃ‚Â ÃƒÆ’Ã†â€™Ãƒâ€šÃ‚Â¢ÃƒÆ’Ã‚Â¢ÃƒÂ¢Ã¢â€šÂ¬Ã…Â¡Ãƒâ€šÃ‚Â¬ÃƒÆ’Ã‚Â¢ÃƒÂ¢Ã¢â€šÂ¬Ã…Â¾Ãƒâ€šÃ‚Â¢ÃƒÆ’Ã†â€™Ãƒâ€ Ã¢â‚¬â„¢ÃƒÆ’Ã¢â‚¬Â ÃƒÂ¢Ã¢â€šÂ¬Ã¢â€žÂ¢ÃƒÆ’Ã†â€™ÃƒÂ¢Ã¢â€šÂ¬Ã…Â¡ÃƒÆ’Ã¢â‚¬Å¡Ãƒâ€šÃ‚Â¢ÃƒÆ’Ã†â€™Ãƒâ€ Ã¢â‚¬â„¢ÃƒÆ’Ã¢â‚¬Å¡Ãƒâ€šÃ‚Â¢ÃƒÆ’Ã†â€™Ãƒâ€šÃ‚Â¢ÃƒÆ’Ã‚Â¢ÃƒÂ¢Ã¢â€šÂ¬Ã…Â¡Ãƒâ€šÃ‚Â¬ÃƒÆ’Ã¢â‚¬Â¦Ãƒâ€šÃ‚Â¡ÃƒÆ’Ã†â€™ÃƒÂ¢Ã¢â€šÂ¬Ã…Â¡ÃƒÆ’Ã¢â‚¬Å¡Ãƒâ€šÃ‚Â¬ÃƒÆ’Ã†â€™Ãƒâ€ Ã¢â‚¬â„¢ÃƒÆ’Ã‚Â¢ÃƒÂ¢Ã¢â‚¬Å¡Ã‚Â¬Ãƒâ€šÃ‚Â¦ÃƒÆ’Ã†â€™ÃƒÂ¢Ã¢â€šÂ¬Ã…Â¡ÃƒÆ’Ã¢â‚¬Å¡Ãƒâ€šÃ‚Â¡ÃƒÆ’Ã†â€™Ãƒâ€ Ã¢â‚¬â„¢ÃƒÆ’Ã¢â‚¬Â ÃƒÂ¢Ã¢â€šÂ¬Ã¢â€žÂ¢ÃƒÆ’Ã†â€™ÃƒÂ¢Ã¢â€šÂ¬Ã‚Â ÃƒÆ’Ã‚Â¢ÃƒÂ¢Ã¢â‚¬Å¡Ã‚Â¬ÃƒÂ¢Ã¢â‚¬Å¾Ã‚Â¢ÃƒÆ’Ã†â€™Ãƒâ€ Ã¢â‚¬â„¢ÃƒÆ’Ã¢â‚¬Å¡Ãƒâ€šÃ‚Â¢ÃƒÆ’Ã†â€™Ãƒâ€šÃ‚Â¢ÃƒÆ’Ã‚Â¢ÃƒÂ¢Ã¢â‚¬Å¡Ã‚Â¬Ãƒâ€¦Ã‚Â¡ÃƒÆ’Ã¢â‚¬Å¡Ãƒâ€šÃ‚Â¬ÃƒÆ’Ã†â€™ÃƒÂ¢Ã¢â€šÂ¬Ã‚Â¦ÃƒÆ’Ã¢â‚¬Å¡Ãƒâ€šÃ‚Â¡ÃƒÆ’Ã†â€™Ãƒâ€ Ã¢â‚¬â„¢ÃƒÆ’Ã¢â‚¬Â ÃƒÂ¢Ã¢â€šÂ¬Ã¢â€žÂ¢ÃƒÆ’Ã†â€™Ãƒâ€šÃ‚Â¢ÃƒÆ’Ã‚Â¢ÃƒÂ¢Ã¢â€šÂ¬Ã…Â¡Ãƒâ€šÃ‚Â¬ÃƒÆ’Ã¢â‚¬Â¦Ãƒâ€šÃ‚Â¡ÃƒÆ’Ã†â€™Ãƒâ€ Ã¢â‚¬â„¢ÃƒÆ’Ã‚Â¢ÃƒÂ¢Ã¢â‚¬Å¡Ã‚Â¬Ãƒâ€¦Ã‚Â¡ÃƒÆ’Ã†â€™ÃƒÂ¢Ã¢â€šÂ¬Ã…Â¡ÃƒÆ’Ã¢â‚¬Å¡Ãƒâ€šÃ‚Â¼g</w:t>
       </w:r>
       <w:proofErr w:type="spellEnd"/>
       <w:r>
@@ -8932,7 +8932,7 @@
           <w:sz w:val="28"/>
           <w:szCs w:val="28"/>
         </w:rPr>
-        <w:t>ÃƒÆ’Ã†â€™Ãƒâ€ Ã¢â‚¬â„¢ÃƒÆ’Ã¢â‚¬Â ÃƒÂ¢Ã¢â€šÂ¬Ã¢â€žÂ¢ÃƒÆ’Ã†â€™ÃƒÂ¢Ã¢â€šÂ¬Ã‚Â ÃƒÆ’Ã‚Â¢ÃƒÂ¢Ã¢â‚¬Å¡Ã‚Â¬ÃƒÂ¢Ã¢â‚¬Å¾Ã‚Â¢ÃƒÆ’Ã†â€™Ãƒâ€ Ã¢â‚¬â„¢ÃƒÆ’Ã‚Â¢ÃƒÂ¢Ã¢â‚¬Å¡Ã‚Â¬Ãƒâ€šÃ‚Â ÃƒÆ’Ã†â€™Ãƒâ€šÃ‚Â¢ÃƒÆ’Ã‚Â¢ÃƒÂ¢Ã¢â€šÂ¬Ã…Â¡Ãƒâ€šÃ‚Â¬ÃƒÆ’Ã‚Â¢ÃƒÂ¢Ã¢â€šÂ¬Ã…Â¾Ãƒâ€šÃ‚Â¢ÃƒÆ’Ã†â€™Ãƒâ€ Ã¢â‚¬â„¢ÃƒÆ’Ã¢â‚¬Â ÃƒÂ¢Ã¢â€šÂ¬Ã¢â€žÂ¢ÃƒÆ’Ã†â€™Ãƒâ€šÃ‚Â¢ÃƒÆ’Ã‚Â¢ÃƒÂ¢Ã¢â€šÂ¬Ã…Â¡Ãƒâ€šÃ‚Â¬ÃƒÆ’Ã¢â‚¬Å¡Ãƒâ€šÃ‚Â ÃƒÆ’Ã†â€™Ãƒâ€ Ã¢â‚¬â„¢ÃƒÆ’Ã¢â‚¬Å¡Ãƒâ€šÃ‚Â¢ÃƒÆ’Ã†â€™Ãƒâ€šÃ‚Â¢ÃƒÆ’Ã‚Â¢ÃƒÂ¢Ã¢â‚¬Å¡Ã‚Â¬Ãƒâ€¦Ã‚Â¡ÃƒÆ’Ã¢â‚¬Å¡Ãƒâ€šÃ‚Â¬ÃƒÆ’Ã†â€™Ãƒâ€šÃ‚Â¢ÃƒÆ’Ã‚Â¢ÃƒÂ¢Ã¢â‚¬Å¡Ã‚Â¬Ãƒâ€¦Ã‚Â¾ÃƒÆ’Ã¢â‚¬Å¡Ãƒâ€šÃ‚Â¢ÃƒÆ’Ã†â€™Ãƒâ€ Ã¢â‚¬â„¢ÃƒÆ’Ã¢â‚¬Â ÃƒÂ¢Ã¢â€šÂ¬Ã¢â€žÂ¢ÃƒÆ’Ã†â€™ÃƒÂ¢Ã¢â€šÂ¬Ã‚Â ÃƒÆ’Ã‚Â¢ÃƒÂ¢Ã¢â‚¬Å¡Ã‚Â¬ÃƒÂ¢Ã¢â‚¬Å¾Ã‚Â¢ÃƒÆ’Ã†â€™Ãƒâ€ Ã¢â‚¬â„¢ÃƒÆ’Ã¢â‚¬Å¡Ãƒâ€šÃ‚Â¢ÃƒÆ’Ã†â€™Ãƒâ€šÃ‚Â¢ÃƒÆ’Ã‚Â¢ÃƒÂ¢Ã¢â‚¬Å¡Ã‚Â¬Ãƒâ€¦Ã‚Â¡ÃƒÆ’Ã¢â‚¬Å¡Ãƒâ€šÃ‚Â¬ÃƒÆ’Ã†â€™ÃƒÂ¢Ã¢â€šÂ¬Ã…Â¡ÃƒÆ’Ã¢â‚¬Å¡Ãƒâ€šÃ‚Â¦ÃƒÆ’Ã†â€™Ãƒâ€ Ã¢â‚¬â„¢ÃƒÆ’Ã¢â‚¬Â ÃƒÂ¢Ã¢â€šÂ¬Ã¢â€žÂ¢ÃƒÆ’Ã†â€™Ãƒâ€šÃ‚Â¢ÃƒÆ’Ã‚Â¢ÃƒÂ¢Ã¢â€šÂ¬Ã…Â¡Ãƒâ€šÃ‚Â¬ÃƒÆ’Ã¢â‚¬Â¦Ãƒâ€šÃ‚Â¡ÃƒÆ’Ã†â€™Ãƒâ€ Ã¢â‚¬â„¢ÃƒÆ’Ã‚Â¢ÃƒÂ¢Ã¢â‚¬Å¡Ã‚Â¬Ãƒâ€¦Ã‚Â¡ÃƒÆ’Ã†â€™ÃƒÂ¢Ã¢â€šÂ¬Ã…Â¡ÃƒÆ’Ã¢â‚¬Å¡Ãƒâ€šÃ‚Â½ÃƒÆ’Ã†â€™Ãƒâ€ Ã¢â‚¬â„¢ÃƒÆ’Ã¢â‚¬Â ÃƒÂ¢Ã¢â€šÂ¬Ã¢â€žÂ¢ÃƒÆ’Ã†â€™ÃƒÂ¢Ã¢â€šÂ¬Ã‚Â ÃƒÆ’Ã‚Â¢ÃƒÂ¢Ã¢â‚¬Å¡Ã‚Â¬ÃƒÂ¢Ã¢â‚¬Å¾Ã‚Â¢ÃƒÆ’Ã†â€™Ãƒâ€ Ã¢â‚¬â„¢ÃƒÆ’Ã‚Â¢ÃƒÂ¢Ã¢â‚¬Å¡Ã‚Â¬Ãƒâ€šÃ‚Â ÃƒÆ’Ã†â€™Ãƒâ€šÃ‚Â¢ÃƒÆ’Ã‚Â¢ÃƒÂ¢Ã¢â€šÂ¬Ã…Â¡Ãƒâ€šÃ‚Â¬ÃƒÆ’Ã‚Â¢ÃƒÂ¢Ã¢â€šÂ¬Ã…Â¾Ãƒâ€šÃ‚Â¢ÃƒÆ’Ã†â€™Ãƒâ€ Ã¢â‚¬â„¢ÃƒÆ’Ã¢â‚¬Â ÃƒÂ¢Ã¢â€šÂ¬Ã¢â€žÂ¢ÃƒÆ’Ã†â€™ÃƒÂ¢Ã¢â€šÂ¬Ã…Â¡ÃƒÆ’Ã¢â‚¬Å¡Ãƒâ€šÃ‚Â¢ÃƒÆ’Ã†â€™Ãƒâ€ Ã¢â‚¬â„¢ÃƒÆ’Ã¢â‚¬Å¡Ãƒâ€šÃ‚Â¢ÃƒÆ’Ã†â€™Ãƒâ€šÃ‚Â¢ÃƒÆ’Ã‚Â¢ÃƒÂ¢Ã¢â€šÂ¬Ã…Â¡Ãƒâ€šÃ‚Â¬ÃƒÆ’Ã¢â‚¬Â¦Ãƒâ€šÃ‚Â¡ÃƒÆ’Ã†â€™ÃƒÂ¢Ã¢â€šÂ¬Ã…Â¡ÃƒÆ’Ã¢â‚¬Å¡Ãƒâ€šÃ‚Â¬ÃƒÆ’Ã†â€™Ãƒâ€ Ã¢â‚¬â„¢ÃƒÆ’Ã‚Â¢ÃƒÂ¢Ã¢â‚¬Å¡Ã‚Â¬Ãƒâ€šÃ‚Â¦ÃƒÆ’Ã†â€™ÃƒÂ¢Ã¢â€šÂ¬Ã…Â¡ÃƒÆ’Ã¢â‚¬Å¡Ãƒâ€šÃ‚Â¡ÃƒÆ’Ã†â€™Ãƒâ€ Ã¢â‚¬â„¢ÃƒÆ’Ã¢â‚¬Â ÃƒÂ¢Ã¢â€šÂ¬Ã¢â€žÂ¢ÃƒÆ’Ã†â€™ÃƒÂ¢Ã¢â€šÂ¬Ã‚Â ÃƒÆ’Ã‚Â¢ÃƒÂ¢Ã¢â‚¬Å¡Ã‚Â¬ÃƒÂ¢Ã¢â‚¬Å¾Ã‚Â¢ÃƒÆ’Ã†â€™Ãƒâ€ Ã¢â‚¬â„¢ÃƒÆ’Ã¢â‚¬Å¡Ãƒâ€šÃ‚Â¢ÃƒÆ’Ã†â€™Ãƒâ€šÃ‚Â¢ÃƒÆ’Ã‚Â¢ÃƒÂ¢Ã¢â‚¬Å¡Ã‚Â¬Ãƒâ€¦Ã‚Â¡ÃƒÆ’Ã¢â‚¬Å¡Ãƒâ€šÃ‚Â¬ÃƒÆ’Ã†â€™ÃƒÂ¢Ã¢â€šÂ¬Ã‚Â¦ÃƒÆ’Ã¢â‚¬Å¡Ãƒâ€šÃ‚Â¡ÃƒÆ’Ã†â€™Ãƒâ€ Ã¢â‚¬â„¢ÃƒÆ’Ã¢â‚¬Â ÃƒÂ¢Ã¢â€šÂ¬Ã¢â€žÂ¢ÃƒÆ’Ã†â€™Ãƒâ€šÃ‚Â¢ÃƒÆ’Ã‚Â¢ÃƒÂ¢Ã¢â€šÂ¬Ã…Â¡Ãƒâ€šÃ‚Â¬ÃƒÆ’Ã¢â‚¬Â¦Ãƒâ€šÃ‚Â¡ÃƒÆ’Ã†â€™Ãƒâ€ Ã¢â‚¬â„¢ÃƒÆ’Ã‚Â¢ÃƒÂ¢Ã¢â‚¬Å¡Ã‚Â¬Ãƒâ€¦Ã‚Â¡ÃƒÆ’Ã†â€™ÃƒÂ¢Ã¢â€šÂ¬Ã…Â¡ÃƒÆ’Ã¢â‚¬Å¡Ãƒâ€šÃ‚Â¼g</w:t>
+        <w:t>ÃƒÆ’Ã†â€™Ãƒâ€ Ã¢â‚¬â„¢ÃƒÆ’Ã¢â‚¬Â ÃƒÂ¢Ã¢â€šÂ¬Ã¢â€žÂ¢ÃƒÆ’Ã†â€™ÃƒÂ¢Ã¢â€šÂ¬Ã‚Â ÃƒÆ’Ã‚Â¢ÃƒÂ¢Ã¢â‚¬Å¡Ã‚Â¬ÃƒÂ¢Ã¢â‚¬Å¾Ã‚Â¢ÃƒÆ’Ã†â€™Ãƒâ€ Ã¢â‚¬â„¢ÃƒÆ’Ã‚Â¢ÃƒÂ¢Ã¢â‚¬Å¡Ã‚Â¬Ãƒâ€šÃ‚Â ÃƒÆ’Ã†â€™Ãƒâ€šÃ‚Â¢ÃƒÆ’Ã‚Â¢ÃƒÂ¢Ã¢â€šÂ¬Ã…Â¡Ãƒâ€šÃ‚Â¬ÃƒÆ’Ã‚Â¢ÃƒÂ¢Ã¢â€šÂ¬Ã…Â¾Ãƒâ€šÃ‚Â¢ÃƒÆ’Ã†â€™Ãƒâ€ Ã¢â‚¬â„¢ÃƒÆ’Ã¢â‚¬Â ÃƒÂ¢Ã¢â€šÂ¬Ã¢â€žÂ¢ÃƒÆ’Ã†â€™Ãƒâ€šÃ‚Â¢ÃƒÆ’Ã‚Â¢ÃƒÂ¢Ã¢â€šÂ¬Ã…Â¡Ãƒâ€šÃ‚Â¬ÃƒÆ’Ã¢â‚¬Å¡Ãƒâ€šÃ‚Â ÃƒÆ’Ã†â€™Ãƒâ€ Ã¢â‚¬â„¢ÃƒÆ’Ã¢â‚¬Å¡Ãƒâ€šÃ‚Â¢ÃƒÆ’Ã†â€™Ãƒâ€šÃ‚Â¢ÃƒÆ’Ã‚Â¢ÃƒÂ¢Ã¢â‚¬Å¡Ã‚Â¬Ãƒâ€¦Ã‚Â¡ÃƒÆ’Ã¢â‚¬Å¡Ãƒâ€šÃ‚Â¬ÃƒÆ’Ã†â€™Ãƒâ€šÃ‚Â¢ÃƒÆ’Ã‚Â¢ÃƒÂ¢Ã¢â‚¬Å¡Ã‚Â¬Ãƒâ€¦Ã‚Â¾ÃƒÆ’Ã¢â‚¬Å¡Ãƒâ€šÃ‚Â¢ÃƒÆ’Ã†â€™Ãƒâ€ Ã¢â‚¬â„¢ÃƒÆ’Ã¢â‚¬Â ÃƒÂ¢Ã¢â€šÂ¬Ã¢â€žÂ¢ÃƒÆ’Ã†â€™ÃƒÂ¢Ã¢â€šÂ¬Ã‚Â ÃƒÆ’Ã‚Â¢ÃƒÂ¢Ã¢â‚¬Å¡Ã‚Â¬ÃƒÂ¢Ã¢â‚¬Å¾Ã‚Â¢ÃƒÆ’Ã†â€™Ãƒâ€ Ã¢â‚¬â„¢ÃƒÆ’Ã¢â‚¬Å¡Ãƒâ€šÃ‚Â¢ÃƒÆ’Ã†â€™Ãƒâ€šÃ‚Â¢ÃƒÆ’Ã‚Â¢ÃƒÂ¢Ã¢â‚¬Å¡Ã‚Â¬Ãƒâ€¦Ã‚Â¡ÃƒÆ’Ã¢â‚¬Å¡Ãƒâ€šÃ‚Â¬ÃƒÆ’Ã†â€™ÃƒÂ¢Ã¢â€šÂ¬Ã…Â¡ÃƒÆ’Ã¢â‚¬Å¡Ãƒâ€šÃ‚Â ÃƒÆ’Ã†â€™Ãƒâ€ Ã¢â‚¬â„¢ÃƒÆ’Ã¢â‚¬Â ÃƒÂ¢Ã¢â€šÂ¬Ã¢â€žÂ¢ÃƒÆ’Ã†â€™ÃƒÂ¢Ã¢â€šÂ¬Ã…Â¡ÃƒÆ’Ã¢â‚¬Å¡Ãƒâ€šÃ‚Â¢ÃƒÆ’Ã†â€™Ãƒâ€ Ã¢â‚¬â„¢ÃƒÆ’Ã¢â‚¬Å¡Ãƒâ€šÃ‚Â¢ÃƒÆ’Ã†â€™Ãƒâ€šÃ‚Â¢ÃƒÆ’Ã‚Â¢ÃƒÂ¢Ã¢â€šÂ¬Ã…Â¡Ãƒâ€šÃ‚Â¬ÃƒÆ’Ã¢â‚¬Â¦Ãƒâ€šÃ‚Â¡ÃƒÆ’Ã†â€™ÃƒÂ¢Ã¢â€šÂ¬Ã…Â¡ÃƒÆ’Ã¢â‚¬Å¡Ãƒâ€šÃ‚Â¬ÃƒÆ’Ã†â€™Ãƒâ€ Ã¢â‚¬â„¢ÃƒÆ’Ã¢â‚¬Å¡Ãƒâ€šÃ‚Â¢ÃƒÆ’Ã†â€™Ãƒâ€šÃ‚Â¢ÃƒÆ’Ã‚Â¢ÃƒÂ¢Ã¢â€šÂ¬Ã…Â¡Ãƒâ€šÃ‚Â¬ÃƒÆ’Ã¢â‚¬Â¦Ãƒâ€šÃ‚Â¾ÃƒÆ’Ã†â€™ÃƒÂ¢Ã¢â€šÂ¬Ã…Â¡ÃƒÆ’Ã¢â‚¬Å¡Ãƒâ€šÃ‚Â¢ÃƒÆ’Ã†â€™Ãƒâ€ Ã¢â‚¬â„¢ÃƒÆ’Ã¢â‚¬Â ÃƒÂ¢Ã¢â€šÂ¬Ã¢â€žÂ¢ÃƒÆ’Ã†â€™ÃƒÂ¢Ã¢â€šÂ¬Ã‚Â ÃƒÆ’Ã‚Â¢ÃƒÂ¢Ã¢â‚¬Å¡Ã‚Â¬ÃƒÂ¢Ã¢â‚¬Å¾Ã‚Â¢ÃƒÆ’Ã†â€™Ãƒâ€ Ã¢â‚¬â„¢ÃƒÆ’Ã‚Â¢ÃƒÂ¢Ã¢â‚¬Å¡Ã‚Â¬Ãƒâ€šÃ‚Â ÃƒÆ’Ã†â€™Ãƒâ€šÃ‚Â¢ÃƒÆ’Ã‚Â¢ÃƒÂ¢Ã¢â€šÂ¬Ã…Â¡Ãƒâ€šÃ‚Â¬ÃƒÆ’Ã‚Â¢ÃƒÂ¢Ã¢â€šÂ¬Ã…Â¾Ãƒâ€šÃ‚Â¢ÃƒÆ’Ã†â€™Ãƒâ€ Ã¢â‚¬â„¢ÃƒÆ’Ã¢â‚¬Â ÃƒÂ¢Ã¢â€šÂ¬Ã¢â€žÂ¢ÃƒÆ’Ã†â€™ÃƒÂ¢Ã¢â€šÂ¬Ã…Â¡ÃƒÆ’Ã¢â‚¬Å¡Ãƒâ€šÃ‚Â¢ÃƒÆ’Ã†â€™Ãƒâ€ Ã¢â‚¬â„¢ÃƒÆ’Ã¢â‚¬Å¡Ãƒâ€šÃ‚Â¢ÃƒÆ’Ã†â€™Ãƒâ€šÃ‚Â¢ÃƒÆ’Ã‚Â¢ÃƒÂ¢Ã¢â€šÂ¬Ã…Â¡Ãƒâ€šÃ‚Â¬ÃƒÆ’Ã¢â‚¬Â¦Ãƒâ€šÃ‚Â¡ÃƒÆ’Ã†â€™ÃƒÂ¢Ã¢â€šÂ¬Ã…Â¡ÃƒÆ’Ã¢â‚¬Å¡Ãƒâ€šÃ‚Â¬ÃƒÆ’Ã†â€™Ãƒâ€ Ã¢â‚¬â„¢ÃƒÆ’Ã‚Â¢ÃƒÂ¢Ã¢â‚¬Å¡Ã‚Â¬Ãƒâ€¦Ã‚Â¡ÃƒÆ’Ã†â€™ÃƒÂ¢Ã¢â€šÂ¬Ã…Â¡ÃƒÆ’Ã¢â‚¬Å¡Ãƒâ€šÃ‚Â¦ÃƒÆ’Ã†â€™Ãƒâ€ Ã¢â‚¬â„¢ÃƒÆ’Ã¢â‚¬Â ÃƒÂ¢Ã¢â€šÂ¬Ã¢â€žÂ¢ÃƒÆ’Ã†â€™ÃƒÂ¢Ã¢â€šÂ¬Ã‚Â ÃƒÆ’Ã‚Â¢ÃƒÂ¢Ã¢â‚¬Å¡Ã‚Â¬ÃƒÂ¢Ã¢â‚¬Å¾Ã‚Â¢ÃƒÆ’Ã†â€™Ãƒâ€ Ã¢â‚¬â„¢ÃƒÆ’Ã¢â‚¬Å¡Ãƒâ€šÃ‚Â¢ÃƒÆ’Ã†â€™Ãƒâ€šÃ‚Â¢ÃƒÆ’Ã‚Â¢ÃƒÂ¢Ã¢â‚¬Å¡Ã‚Â¬Ãƒâ€¦Ã‚Â¡ÃƒÆ’Ã¢â‚¬Å¡Ãƒâ€šÃ‚Â¬ÃƒÆ’Ã†â€™ÃƒÂ¢Ã¢â€šÂ¬Ã‚Â¦ÃƒÆ’Ã¢â‚¬Å¡Ãƒâ€šÃ‚Â¡ÃƒÆ’Ã†â€™Ãƒâ€ Ã¢â‚¬â„¢ÃƒÆ’Ã¢â‚¬Â ÃƒÂ¢Ã¢â€šÂ¬Ã¢â€žÂ¢ÃƒÆ’Ã†â€™Ãƒâ€šÃ‚Â¢ÃƒÆ’Ã‚Â¢ÃƒÂ¢Ã¢â€šÂ¬Ã…Â¡Ãƒâ€šÃ‚Â¬ÃƒÆ’Ã¢â‚¬Â¦Ãƒâ€šÃ‚Â¡ÃƒÆ’Ã†â€™Ãƒâ€ Ã¢â‚¬â„¢ÃƒÆ’Ã‚Â¢ÃƒÂ¢Ã¢â‚¬Å¡Ã‚Â¬Ãƒâ€¦Ã‚Â¡ÃƒÆ’Ã†â€™ÃƒÂ¢Ã¢â€šÂ¬Ã…Â¡ÃƒÆ’Ã¢â‚¬Å¡Ãƒâ€šÃ‚Â½ÃƒÆ’Ã†â€™Ãƒâ€ Ã¢â‚¬â„¢ÃƒÆ’Ã¢â‚¬Â ÃƒÂ¢Ã¢â€šÂ¬Ã¢â€žÂ¢ÃƒÆ’Ã†â€™ÃƒÂ¢Ã¢â€šÂ¬Ã‚Â ÃƒÆ’Ã‚Â¢ÃƒÂ¢Ã¢â‚¬Å¡Ã‚Â¬ÃƒÂ¢Ã¢â‚¬Å¾Ã‚Â¢ÃƒÆ’Ã†â€™Ãƒâ€ Ã¢â‚¬â„¢ÃƒÆ’Ã‚Â¢ÃƒÂ¢Ã¢â‚¬Å¡Ã‚Â¬Ãƒâ€šÃ‚Â ÃƒÆ’Ã†â€™Ãƒâ€šÃ‚Â¢ÃƒÆ’Ã‚Â¢ÃƒÂ¢Ã¢â€šÂ¬Ã…Â¡Ãƒâ€šÃ‚Â¬ÃƒÆ’Ã‚Â¢ÃƒÂ¢Ã¢â€šÂ¬Ã…Â¾Ãƒâ€šÃ‚Â¢ÃƒÆ’Ã†â€™Ãƒâ€ Ã¢â‚¬â„¢ÃƒÆ’Ã¢â‚¬Â ÃƒÂ¢Ã¢â€šÂ¬Ã¢â€žÂ¢ÃƒÆ’Ã†â€™Ãƒâ€šÃ‚Â¢ÃƒÆ’Ã‚Â¢ÃƒÂ¢Ã¢â€šÂ¬Ã…Â¡Ãƒâ€šÃ‚Â¬ÃƒÆ’Ã¢â‚¬Å¡Ãƒâ€šÃ‚Â ÃƒÆ’Ã†â€™Ãƒâ€ Ã¢â‚¬â„¢ÃƒÆ’Ã¢â‚¬Å¡Ãƒâ€šÃ‚Â¢ÃƒÆ’Ã†â€™Ãƒâ€šÃ‚Â¢ÃƒÆ’Ã‚Â¢ÃƒÂ¢Ã¢â‚¬Å¡Ã‚Â¬Ãƒâ€¦Ã‚Â¡ÃƒÆ’Ã¢â‚¬Å¡Ãƒâ€šÃ‚Â¬ÃƒÆ’Ã†â€™Ãƒâ€šÃ‚Â¢ÃƒÆ’Ã‚Â¢ÃƒÂ¢Ã¢â‚¬Å¡Ã‚Â¬Ãƒâ€¦Ã‚Â¾ÃƒÆ’Ã¢â‚¬Å¡Ãƒâ€šÃ‚Â¢ÃƒÆ’Ã†â€™Ãƒâ€ Ã¢â‚¬â„¢ÃƒÆ’Ã¢â‚¬Â ÃƒÂ¢Ã¢â€šÂ¬Ã¢â€žÂ¢ÃƒÆ’Ã†â€™ÃƒÂ¢Ã¢â€šÂ¬Ã‚Â ÃƒÆ’Ã‚Â¢ÃƒÂ¢Ã¢â‚¬Å¡Ã‚Â¬ÃƒÂ¢Ã¢â‚¬Å¾Ã‚Â¢ÃƒÆ’Ã†â€™Ãƒâ€ Ã¢â‚¬â„¢ÃƒÆ’Ã‚Â¢ÃƒÂ¢Ã¢â‚¬Å¡Ã‚Â¬Ãƒâ€¦Ã‚Â¡ÃƒÆ’Ã†â€™ÃƒÂ¢Ã¢â€šÂ¬Ã…Â¡ÃƒÆ’Ã¢â‚¬Å¡Ãƒâ€šÃ‚Â¢ÃƒÆ’Ã†â€™Ãƒâ€ Ã¢â‚¬â„¢ÃƒÆ’Ã¢â‚¬Â ÃƒÂ¢Ã¢â€šÂ¬Ã¢â€žÂ¢ÃƒÆ’Ã†â€™ÃƒÂ¢Ã¢â€šÂ¬Ã…Â¡ÃƒÆ’Ã¢â‚¬Å¡Ãƒâ€šÃ‚Â¢ÃƒÆ’Ã†â€™Ãƒâ€ Ã¢â‚¬â„¢ÃƒÆ’Ã¢â‚¬Å¡Ãƒâ€šÃ‚Â¢ÃƒÆ’Ã†â€™Ãƒâ€šÃ‚Â¢ÃƒÆ’Ã‚Â¢ÃƒÂ¢Ã¢â‚¬Å¡Ã‚Â¬Ãƒâ€¦Ã‚Â¡ÃƒÆ’Ã¢â‚¬Å¡Ãƒâ€šÃ‚Â¬ÃƒÆ’Ã†â€™ÃƒÂ¢Ã¢â€šÂ¬Ã‚Â¦ÃƒÆ’Ã¢â‚¬Å¡Ãƒâ€šÃ‚Â¡ÃƒÆ’Ã†â€™Ãƒâ€ Ã¢â‚¬â„¢ÃƒÆ’Ã‚Â¢ÃƒÂ¢Ã¢â‚¬Å¡Ã‚Â¬Ãƒâ€¦Ã‚Â¡ÃƒÆ’Ã†â€™ÃƒÂ¢Ã¢â€šÂ¬Ã…Â¡ÃƒÆ’Ã¢â‚¬Å¡Ãƒâ€šÃ‚Â¬ÃƒÆ’Ã†â€™Ãƒâ€ Ã¢â‚¬â„¢ÃƒÆ’Ã¢â‚¬Â ÃƒÂ¢Ã¢â€šÂ¬Ã¢â€žÂ¢ÃƒÆ’Ã†â€™Ãƒâ€šÃ‚Â¢ÃƒÆ’Ã‚Â¢ÃƒÂ¢Ã¢â€šÂ¬Ã…Â¡Ãƒâ€šÃ‚Â¬ÃƒÆ’Ã¢â‚¬Å¡Ãƒâ€šÃ‚Â¦ÃƒÆ’Ã†â€™Ãƒâ€ Ã¢â‚¬â„¢ÃƒÆ’Ã‚Â¢ÃƒÂ¢Ã¢â‚¬Å¡Ã‚Â¬Ãƒâ€¦Ã‚Â¡ÃƒÆ’Ã†â€™ÃƒÂ¢Ã¢â€šÂ¬Ã…Â¡ÃƒÆ’Ã¢â‚¬Å¡Ãƒâ€šÃ‚Â¡ÃƒÆ’Ã†â€™Ãƒâ€ Ã¢â‚¬â„¢ÃƒÆ’Ã¢â‚¬Â ÃƒÂ¢Ã¢â€šÂ¬Ã¢â€žÂ¢ÃƒÆ’Ã†â€™ÃƒÂ¢Ã¢â€šÂ¬Ã‚Â ÃƒÆ’Ã‚Â¢ÃƒÂ¢Ã¢â‚¬Å¡Ã‚Â¬ÃƒÂ¢Ã¢â‚¬Å¾Ã‚Â¢ÃƒÆ’Ã†â€™Ãƒâ€ Ã¢â‚¬â„¢ÃƒÆ’Ã‚Â¢ÃƒÂ¢Ã¢â‚¬Å¡Ã‚Â¬Ãƒâ€šÃ‚Â ÃƒÆ’Ã†â€™Ãƒâ€šÃ‚Â¢ÃƒÆ’Ã‚Â¢ÃƒÂ¢Ã¢â€šÂ¬Ã…Â¡Ãƒâ€šÃ‚Â¬ÃƒÆ’Ã‚Â¢ÃƒÂ¢Ã¢â€šÂ¬Ã…Â¾Ãƒâ€šÃ‚Â¢ÃƒÆ’Ã†â€™Ãƒâ€ Ã¢â‚¬â„¢ÃƒÆ’Ã¢â‚¬Â ÃƒÂ¢Ã¢â€šÂ¬Ã¢â€žÂ¢ÃƒÆ’Ã†â€™ÃƒÂ¢Ã¢â€šÂ¬Ã…Â¡ÃƒÆ’Ã¢â‚¬Å¡Ãƒâ€šÃ‚Â¢ÃƒÆ’Ã†â€™Ãƒâ€ Ã¢â‚¬â„¢ÃƒÆ’Ã¢â‚¬Å¡Ãƒâ€šÃ‚Â¢ÃƒÆ’Ã†â€™Ãƒâ€šÃ‚Â¢ÃƒÆ’Ã‚Â¢ÃƒÂ¢Ã¢â€šÂ¬Ã…Â¡Ãƒâ€šÃ‚Â¬ÃƒÆ’Ã¢â‚¬Â¦Ãƒâ€šÃ‚Â¡ÃƒÆ’Ã†â€™ÃƒÂ¢Ã¢â€šÂ¬Ã…Â¡ÃƒÆ’Ã¢â‚¬Å¡Ãƒâ€šÃ‚Â¬ÃƒÆ’Ã†â€™Ãƒâ€ Ã¢â‚¬â„¢ÃƒÆ’Ã‚Â¢ÃƒÂ¢Ã¢â‚¬Å¡Ã‚Â¬Ãƒâ€šÃ‚Â¦ÃƒÆ’Ã†â€™ÃƒÂ¢Ã¢â€šÂ¬Ã…Â¡ÃƒÆ’Ã¢â‚¬Å¡Ãƒâ€šÃ‚Â¡ÃƒÆ’Ã†â€™Ãƒâ€ Ã¢â‚¬â„¢ÃƒÆ’Ã¢â‚¬Â ÃƒÂ¢Ã¢â€šÂ¬Ã¢â€žÂ¢ÃƒÆ’Ã†â€™ÃƒÂ¢Ã¢â€šÂ¬Ã‚Â ÃƒÆ’Ã‚Â¢ÃƒÂ¢Ã¢â‚¬Å¡Ã‚Â¬ÃƒÂ¢Ã¢â‚¬Å¾Ã‚Â¢ÃƒÆ’Ã†â€™Ãƒâ€ Ã¢â‚¬â„¢ÃƒÆ’Ã¢â‚¬Å¡Ãƒâ€šÃ‚Â¢ÃƒÆ’Ã†â€™Ãƒâ€šÃ‚Â¢ÃƒÆ’Ã‚Â¢ÃƒÂ¢Ã¢â‚¬Å¡Ã‚Â¬Ãƒâ€¦Ã‚Â¡ÃƒÆ’Ã¢â‚¬Å¡Ãƒâ€šÃ‚Â¬ÃƒÆ’Ã†â€™ÃƒÂ¢Ã¢â€šÂ¬Ã‚Â¦ÃƒÆ’Ã¢â‚¬Å¡Ãƒâ€šÃ‚Â¡ÃƒÆ’Ã†â€™Ãƒâ€ Ã¢â‚¬â„¢ÃƒÆ’Ã¢â‚¬Â ÃƒÂ¢Ã¢â€šÂ¬Ã¢â€žÂ¢ÃƒÆ’Ã†â€™Ãƒâ€šÃ‚Â¢ÃƒÆ’Ã‚Â¢ÃƒÂ¢Ã¢â€šÂ¬Ã…Â¡Ãƒâ€šÃ‚Â¬ÃƒÆ’Ã¢â‚¬Â¦Ãƒâ€šÃ‚Â¡ÃƒÆ’Ã†â€™Ãƒâ€ Ã¢â‚¬â„¢ÃƒÆ’Ã‚Â¢ÃƒÂ¢Ã¢â‚¬Å¡Ã‚Â¬Ãƒâ€¦Ã‚Â¡ÃƒÆ’Ã†â€™ÃƒÂ¢Ã¢â€šÂ¬Ã…Â¡ÃƒÆ’Ã¢â‚¬Å¡Ãƒâ€šÃ‚Â¼g</w:t>
       </w:r>
       <w:proofErr w:type="spellEnd"/>
       <w:r>
@@ -8959,7 +8959,7 @@
           <w:sz w:val="28"/>
           <w:szCs w:val="28"/>
         </w:rPr>
-        <w:t>ÃƒÆ’Ã†â€™Ãƒâ€ Ã¢â‚¬â„¢ÃƒÆ’Ã¢â‚¬Â ÃƒÂ¢Ã¢â€šÂ¬Ã¢â€žÂ¢ÃƒÆ’Ã†â€™ÃƒÂ¢Ã¢â€šÂ¬Ã‚Â ÃƒÆ’Ã‚Â¢ÃƒÂ¢Ã¢â‚¬Å¡Ã‚Â¬ÃƒÂ¢Ã¢â‚¬Å¾Ã‚Â¢ÃƒÆ’Ã†â€™Ãƒâ€ Ã¢â‚¬â„¢ÃƒÆ’Ã‚Â¢ÃƒÂ¢Ã¢â‚¬Å¡Ã‚Â¬Ãƒâ€šÃ‚Â ÃƒÆ’Ã†â€™Ãƒâ€šÃ‚Â¢ÃƒÆ’Ã‚Â¢ÃƒÂ¢Ã¢â€šÂ¬Ã…Â¡Ãƒâ€šÃ‚Â¬ÃƒÆ’Ã‚Â¢ÃƒÂ¢Ã¢â€šÂ¬Ã…Â¾Ãƒâ€šÃ‚Â¢ÃƒÆ’Ã†â€™Ãƒâ€ Ã¢â‚¬â„¢ÃƒÆ’Ã¢â‚¬Â ÃƒÂ¢Ã¢â€šÂ¬Ã¢â€žÂ¢ÃƒÆ’Ã†â€™Ãƒâ€šÃ‚Â¢ÃƒÆ’Ã‚Â¢ÃƒÂ¢Ã¢â€šÂ¬Ã…Â¡Ãƒâ€šÃ‚Â¬ÃƒÆ’Ã¢â‚¬Å¡Ãƒâ€šÃ‚Â ÃƒÆ’Ã†â€™Ãƒâ€ Ã¢â‚¬â„¢ÃƒÆ’Ã¢â‚¬Å¡Ãƒâ€šÃ‚Â¢ÃƒÆ’Ã†â€™Ãƒâ€šÃ‚Â¢ÃƒÆ’Ã‚Â¢ÃƒÂ¢Ã¢â‚¬Å¡Ã‚Â¬Ãƒâ€¦Ã‚Â¡ÃƒÆ’Ã¢â‚¬Å¡Ãƒâ€šÃ‚Â¬ÃƒÆ’Ã†â€™Ãƒâ€šÃ‚Â¢ÃƒÆ’Ã‚Â¢ÃƒÂ¢Ã¢â‚¬Å¡Ã‚Â¬Ãƒâ€¦Ã‚Â¾ÃƒÆ’Ã¢â‚¬Å¡Ãƒâ€šÃ‚Â¢ÃƒÆ’Ã†â€™Ãƒâ€ Ã¢â‚¬â„¢ÃƒÆ’Ã¢â‚¬Â ÃƒÂ¢Ã¢â€šÂ¬Ã¢â€žÂ¢ÃƒÆ’Ã†â€™ÃƒÂ¢Ã¢â€šÂ¬Ã‚Â ÃƒÆ’Ã‚Â¢ÃƒÂ¢Ã¢â‚¬Å¡Ã‚Â¬ÃƒÂ¢Ã¢â‚¬Å¾Ã‚Â¢ÃƒÆ’Ã†â€™Ãƒâ€ Ã¢â‚¬â„¢ÃƒÆ’Ã¢â‚¬Å¡Ãƒâ€šÃ‚Â¢ÃƒÆ’Ã†â€™Ãƒâ€šÃ‚Â¢ÃƒÆ’Ã‚Â¢ÃƒÂ¢Ã¢â‚¬Å¡Ã‚Â¬Ãƒâ€¦Ã‚Â¡ÃƒÆ’Ã¢â‚¬Å¡Ãƒâ€šÃ‚Â¬ÃƒÆ’Ã†â€™ÃƒÂ¢Ã¢â€šÂ¬Ã…Â¡ÃƒÆ’Ã¢â‚¬Å¡Ãƒâ€šÃ‚Â¦ÃƒÆ’Ã†â€™Ãƒâ€ Ã¢â‚¬â„¢ÃƒÆ’Ã¢â‚¬Â ÃƒÂ¢Ã¢â€šÂ¬Ã¢â€žÂ¢ÃƒÆ’Ã†â€™Ãƒâ€šÃ‚Â¢ÃƒÆ’Ã‚Â¢ÃƒÂ¢Ã¢â€šÂ¬Ã…Â¡Ãƒâ€šÃ‚Â¬ÃƒÆ’Ã¢â‚¬Â¦Ãƒâ€šÃ‚Â¡ÃƒÆ’Ã†â€™Ãƒâ€ Ã¢â‚¬â„¢ÃƒÆ’Ã‚Â¢ÃƒÂ¢Ã¢â‚¬Å¡Ã‚Â¬Ãƒâ€¦Ã‚Â¡ÃƒÆ’Ã†â€™ÃƒÂ¢Ã¢â€šÂ¬Ã…Â¡ÃƒÆ’Ã¢â‚¬Å¡Ãƒâ€šÃ‚Â½ÃƒÆ’Ã†â€™Ãƒâ€ Ã¢â‚¬â„¢ÃƒÆ’Ã¢â‚¬Â ÃƒÂ¢Ã¢â€šÂ¬Ã¢â€žÂ¢ÃƒÆ’Ã†â€™ÃƒÂ¢Ã¢â€šÂ¬Ã‚Â ÃƒÆ’Ã‚Â¢ÃƒÂ¢Ã¢â‚¬Å¡Ã‚Â¬ÃƒÂ¢Ã¢â‚¬Å¾Ã‚Â¢ÃƒÆ’Ã†â€™Ãƒâ€ Ã¢â‚¬â„¢ÃƒÆ’Ã‚Â¢ÃƒÂ¢Ã¢â‚¬Å¡Ã‚Â¬Ãƒâ€šÃ‚Â ÃƒÆ’Ã†â€™Ãƒâ€šÃ‚Â¢ÃƒÆ’Ã‚Â¢ÃƒÂ¢Ã¢â€šÂ¬Ã…Â¡Ãƒâ€šÃ‚Â¬ÃƒÆ’Ã‚Â¢ÃƒÂ¢Ã¢â€šÂ¬Ã…Â¾Ãƒâ€šÃ‚Â¢ÃƒÆ’Ã†â€™Ãƒâ€ Ã¢â‚¬â„¢ÃƒÆ’Ã¢â‚¬Â ÃƒÂ¢Ã¢â€šÂ¬Ã¢â€žÂ¢ÃƒÆ’Ã†â€™ÃƒÂ¢Ã¢â€šÂ¬Ã…Â¡ÃƒÆ’Ã¢â‚¬Å¡Ãƒâ€šÃ‚Â¢ÃƒÆ’Ã†â€™Ãƒâ€ Ã¢â‚¬â„¢ÃƒÆ’Ã¢â‚¬Å¡Ãƒâ€šÃ‚Â¢ÃƒÆ’Ã†â€™Ãƒâ€šÃ‚Â¢ÃƒÆ’Ã‚Â¢ÃƒÂ¢Ã¢â€šÂ¬Ã…Â¡Ãƒâ€šÃ‚Â¬ÃƒÆ’Ã¢â‚¬Â¦Ãƒâ€šÃ‚Â¡ÃƒÆ’Ã†â€™ÃƒÂ¢Ã¢â€šÂ¬Ã…Â¡ÃƒÆ’Ã¢â‚¬Å¡Ãƒâ€šÃ‚Â¬ÃƒÆ’Ã†â€™Ãƒâ€ Ã¢â‚¬â„¢ÃƒÆ’Ã‚Â¢ÃƒÂ¢Ã¢â‚¬Å¡Ã‚Â¬Ãƒâ€šÃ‚Â¦ÃƒÆ’Ã†â€™ÃƒÂ¢Ã¢â€šÂ¬Ã…Â¡ÃƒÆ’Ã¢â‚¬Å¡Ãƒâ€šÃ‚Â¡ÃƒÆ’Ã†â€™Ãƒâ€ Ã¢â‚¬â„¢ÃƒÆ’Ã¢â‚¬Â ÃƒÂ¢Ã¢â€šÂ¬Ã¢â€žÂ¢ÃƒÆ’Ã†â€™ÃƒÂ¢Ã¢â€šÂ¬Ã‚Â ÃƒÆ’Ã‚Â¢ÃƒÂ¢Ã¢â‚¬Å¡Ã‚Â¬ÃƒÂ¢Ã¢â‚¬Å¾Ã‚Â¢ÃƒÆ’Ã†â€™Ãƒâ€ Ã¢â‚¬â„¢ÃƒÆ’Ã¢â‚¬Å¡Ãƒâ€šÃ‚Â¢ÃƒÆ’Ã†â€™Ãƒâ€šÃ‚Â¢ÃƒÆ’Ã‚Â¢ÃƒÂ¢Ã¢â‚¬Å¡Ã‚Â¬Ãƒâ€¦Ã‚Â¡ÃƒÆ’Ã¢â‚¬Å¡Ãƒâ€šÃ‚Â¬ÃƒÆ’Ã†â€™ÃƒÂ¢Ã¢â€šÂ¬Ã‚Â¦ÃƒÆ’Ã¢â‚¬Å¡Ãƒâ€šÃ‚Â¡ÃƒÆ’Ã†â€™Ãƒâ€ Ã¢â‚¬â„¢ÃƒÆ’Ã¢â‚¬Â ÃƒÂ¢Ã¢â€šÂ¬Ã¢â€žÂ¢ÃƒÆ’Ã†â€™Ãƒâ€šÃ‚Â¢ÃƒÆ’Ã‚Â¢ÃƒÂ¢Ã¢â€šÂ¬Ã…Â¡Ãƒâ€šÃ‚Â¬ÃƒÆ’Ã¢â‚¬Â¦Ãƒâ€šÃ‚Â¡ÃƒÆ’Ã†â€™Ãƒâ€ Ã¢â‚¬â„¢ÃƒÆ’Ã‚Â¢ÃƒÂ¢Ã¢â‚¬Å¡Ã‚Â¬Ãƒâ€¦Ã‚Â¡ÃƒÆ’Ã†â€™ÃƒÂ¢Ã¢â€šÂ¬Ã…Â¡ÃƒÆ’Ã¢â‚¬Å¡Ãƒâ€šÃ‚Â¼g</w:t>
+        <w:t>ÃƒÆ’Ã†â€™Ãƒâ€ Ã¢â‚¬â„¢ÃƒÆ’Ã¢â‚¬Â ÃƒÂ¢Ã¢â€šÂ¬Ã¢â€žÂ¢ÃƒÆ’Ã†â€™ÃƒÂ¢Ã¢â€šÂ¬Ã‚Â ÃƒÆ’Ã‚Â¢ÃƒÂ¢Ã¢â‚¬Å¡Ã‚Â¬ÃƒÂ¢Ã¢â‚¬Å¾Ã‚Â¢ÃƒÆ’Ã†â€™Ãƒâ€ Ã¢â‚¬â„¢ÃƒÆ’Ã‚Â¢ÃƒÂ¢Ã¢â‚¬Å¡Ã‚Â¬Ãƒâ€šÃ‚Â ÃƒÆ’Ã†â€™Ãƒâ€šÃ‚Â¢ÃƒÆ’Ã‚Â¢ÃƒÂ¢Ã¢â€šÂ¬Ã…Â¡Ãƒâ€šÃ‚Â¬ÃƒÆ’Ã‚Â¢ÃƒÂ¢Ã¢â€šÂ¬Ã…Â¾Ãƒâ€šÃ‚Â¢ÃƒÆ’Ã†â€™Ãƒâ€ Ã¢â‚¬â„¢ÃƒÆ’Ã¢â‚¬Â ÃƒÂ¢Ã¢â€šÂ¬Ã¢â€žÂ¢ÃƒÆ’Ã†â€™Ãƒâ€šÃ‚Â¢ÃƒÆ’Ã‚Â¢ÃƒÂ¢Ã¢â€šÂ¬Ã…Â¡Ãƒâ€šÃ‚Â¬ÃƒÆ’Ã¢â‚¬Å¡Ãƒâ€šÃ‚Â ÃƒÆ’Ã†â€™Ãƒâ€ Ã¢â‚¬â„¢ÃƒÆ’Ã¢â‚¬Å¡Ãƒâ€šÃ‚Â¢ÃƒÆ’Ã†â€™Ãƒâ€šÃ‚Â¢ÃƒÆ’Ã‚Â¢ÃƒÂ¢Ã¢â‚¬Å¡Ã‚Â¬Ãƒâ€¦Ã‚Â¡ÃƒÆ’Ã¢â‚¬Å¡Ãƒâ€šÃ‚Â¬ÃƒÆ’Ã†â€™Ãƒâ€šÃ‚Â¢ÃƒÆ’Ã‚Â¢ÃƒÂ¢Ã¢â‚¬Å¡Ã‚Â¬Ãƒâ€¦Ã‚Â¾ÃƒÆ’Ã¢â‚¬Å¡Ãƒâ€šÃ‚Â¢ÃƒÆ’Ã†â€™Ãƒâ€ Ã¢â‚¬â„¢ÃƒÆ’Ã¢â‚¬Â ÃƒÂ¢Ã¢â€šÂ¬Ã¢â€žÂ¢ÃƒÆ’Ã†â€™ÃƒÂ¢Ã¢â€šÂ¬Ã‚Â ÃƒÆ’Ã‚Â¢ÃƒÂ¢Ã¢â‚¬Å¡Ã‚Â¬ÃƒÂ¢Ã¢â‚¬Å¾Ã‚Â¢ÃƒÆ’Ã†â€™Ãƒâ€ Ã¢â‚¬â„¢ÃƒÆ’Ã¢â‚¬Å¡Ãƒâ€šÃ‚Â¢ÃƒÆ’Ã†â€™Ãƒâ€šÃ‚Â¢ÃƒÆ’Ã‚Â¢ÃƒÂ¢Ã¢â‚¬Å¡Ã‚Â¬Ãƒâ€¦Ã‚Â¡ÃƒÆ’Ã¢â‚¬Å¡Ãƒâ€šÃ‚Â¬ÃƒÆ’Ã†â€™ÃƒÂ¢Ã¢â€šÂ¬Ã…Â¡ÃƒÆ’Ã¢â‚¬Å¡Ãƒâ€šÃ‚Â ÃƒÆ’Ã†â€™Ãƒâ€ Ã¢â‚¬â„¢ÃƒÆ’Ã¢â‚¬Â ÃƒÂ¢Ã¢â€šÂ¬Ã¢â€žÂ¢ÃƒÆ’Ã†â€™ÃƒÂ¢Ã¢â€šÂ¬Ã…Â¡ÃƒÆ’Ã¢â‚¬Å¡Ãƒâ€šÃ‚Â¢ÃƒÆ’Ã†â€™Ãƒâ€ Ã¢â‚¬â„¢ÃƒÆ’Ã¢â‚¬Å¡Ãƒâ€šÃ‚Â¢ÃƒÆ’Ã†â€™Ãƒâ€šÃ‚Â¢ÃƒÆ’Ã‚Â¢ÃƒÂ¢Ã¢â€šÂ¬Ã…Â¡Ãƒâ€šÃ‚Â¬ÃƒÆ’Ã¢â‚¬Â¦Ãƒâ€šÃ‚Â¡ÃƒÆ’Ã†â€™ÃƒÂ¢Ã¢â€šÂ¬Ã…Â¡ÃƒÆ’Ã¢â‚¬Å¡Ãƒâ€šÃ‚Â¬ÃƒÆ’Ã†â€™Ãƒâ€ Ã¢â‚¬â„¢ÃƒÆ’Ã¢â‚¬Å¡Ãƒâ€šÃ‚Â¢ÃƒÆ’Ã†â€™Ãƒâ€šÃ‚Â¢ÃƒÆ’Ã‚Â¢ÃƒÂ¢Ã¢â€šÂ¬Ã…Â¡Ãƒâ€šÃ‚Â¬ÃƒÆ’Ã¢â‚¬Â¦Ãƒâ€šÃ‚Â¾ÃƒÆ’Ã†â€™ÃƒÂ¢Ã¢â€šÂ¬Ã…Â¡ÃƒÆ’Ã¢â‚¬Å¡Ãƒâ€šÃ‚Â¢ÃƒÆ’Ã†â€™Ãƒâ€ Ã¢â‚¬â„¢ÃƒÆ’Ã¢â‚¬Â ÃƒÂ¢Ã¢â€šÂ¬Ã¢â€žÂ¢ÃƒÆ’Ã†â€™ÃƒÂ¢Ã¢â€šÂ¬Ã‚Â ÃƒÆ’Ã‚Â¢ÃƒÂ¢Ã¢â‚¬Å¡Ã‚Â¬ÃƒÂ¢Ã¢â‚¬Å¾Ã‚Â¢ÃƒÆ’Ã†â€™Ãƒâ€ Ã¢â‚¬â„¢ÃƒÆ’Ã‚Â¢ÃƒÂ¢Ã¢â‚¬Å¡Ã‚Â¬Ãƒâ€šÃ‚Â ÃƒÆ’Ã†â€™Ãƒâ€šÃ‚Â¢ÃƒÆ’Ã‚Â¢ÃƒÂ¢Ã¢â€šÂ¬Ã…Â¡Ãƒâ€šÃ‚Â¬ÃƒÆ’Ã‚Â¢ÃƒÂ¢Ã¢â€šÂ¬Ã…Â¾Ãƒâ€šÃ‚Â¢ÃƒÆ’Ã†â€™Ãƒâ€ Ã¢â‚¬â„¢ÃƒÆ’Ã¢â‚¬Â ÃƒÂ¢Ã¢â€šÂ¬Ã¢â€žÂ¢ÃƒÆ’Ã†â€™ÃƒÂ¢Ã¢â€šÂ¬Ã…Â¡ÃƒÆ’Ã¢â‚¬Å¡Ãƒâ€šÃ‚Â¢ÃƒÆ’Ã†â€™Ãƒâ€ Ã¢â‚¬â„¢ÃƒÆ’Ã¢â‚¬Å¡Ãƒâ€šÃ‚Â¢ÃƒÆ’Ã†â€™Ãƒâ€šÃ‚Â¢ÃƒÆ’Ã‚Â¢ÃƒÂ¢Ã¢â€šÂ¬Ã…Â¡Ãƒâ€šÃ‚Â¬ÃƒÆ’Ã¢â‚¬Â¦Ãƒâ€šÃ‚Â¡ÃƒÆ’Ã†â€™ÃƒÂ¢Ã¢â€šÂ¬Ã…Â¡ÃƒÆ’Ã¢â‚¬Å¡Ãƒâ€šÃ‚Â¬ÃƒÆ’Ã†â€™Ãƒâ€ Ã¢â‚¬â„¢ÃƒÆ’Ã‚Â¢ÃƒÂ¢Ã¢â‚¬Å¡Ã‚Â¬Ãƒâ€¦Ã‚Â¡ÃƒÆ’Ã†â€™ÃƒÂ¢Ã¢â€šÂ¬Ã…Â¡ÃƒÆ’Ã¢â‚¬Å¡Ãƒâ€šÃ‚Â¦ÃƒÆ’Ã†â€™Ãƒâ€ Ã¢â‚¬â„¢ÃƒÆ’Ã¢â‚¬Â ÃƒÂ¢Ã¢â€šÂ¬Ã¢â€žÂ¢ÃƒÆ’Ã†â€™ÃƒÂ¢Ã¢â€šÂ¬Ã‚Â ÃƒÆ’Ã‚Â¢ÃƒÂ¢Ã¢â‚¬Å¡Ã‚Â¬ÃƒÂ¢Ã¢â‚¬Å¾Ã‚Â¢ÃƒÆ’Ã†â€™Ãƒâ€ Ã¢â‚¬â„¢ÃƒÆ’Ã¢â‚¬Å¡Ãƒâ€šÃ‚Â¢ÃƒÆ’Ã†â€™Ãƒâ€šÃ‚Â¢ÃƒÆ’Ã‚Â¢ÃƒÂ¢Ã¢â‚¬Å¡Ã‚Â¬Ãƒâ€¦Ã‚Â¡ÃƒÆ’Ã¢â‚¬Å¡Ãƒâ€šÃ‚Â¬ÃƒÆ’Ã†â€™ÃƒÂ¢Ã¢â€šÂ¬Ã‚Â¦ÃƒÆ’Ã¢â‚¬Å¡Ãƒâ€šÃ‚Â¡ÃƒÆ’Ã†â€™Ãƒâ€ Ã¢â‚¬â„¢ÃƒÆ’Ã¢â‚¬Â ÃƒÂ¢Ã¢â€šÂ¬Ã¢â€žÂ¢ÃƒÆ’Ã†â€™Ãƒâ€šÃ‚Â¢ÃƒÆ’Ã‚Â¢ÃƒÂ¢Ã¢â€šÂ¬Ã…Â¡Ãƒâ€šÃ‚Â¬ÃƒÆ’Ã¢â‚¬Â¦Ãƒâ€šÃ‚Â¡ÃƒÆ’Ã†â€™Ãƒâ€ Ã¢â‚¬â„¢ÃƒÆ’Ã‚Â¢ÃƒÂ¢Ã¢â‚¬Å¡Ã‚Â¬Ãƒâ€¦Ã‚Â¡ÃƒÆ’Ã†â€™ÃƒÂ¢Ã¢â€šÂ¬Ã…Â¡ÃƒÆ’Ã¢â‚¬Å¡Ãƒâ€šÃ‚Â½ÃƒÆ’Ã†â€™Ãƒâ€ Ã¢â‚¬â„¢ÃƒÆ’Ã¢â‚¬Â ÃƒÂ¢Ã¢â€šÂ¬Ã¢â€žÂ¢ÃƒÆ’Ã†â€™ÃƒÂ¢Ã¢â€šÂ¬Ã‚Â ÃƒÆ’Ã‚Â¢ÃƒÂ¢Ã¢â‚¬Å¡Ã‚Â¬ÃƒÂ¢Ã¢â‚¬Å¾Ã‚Â¢ÃƒÆ’Ã†â€™Ãƒâ€ Ã¢â‚¬â„¢ÃƒÆ’Ã‚Â¢ÃƒÂ¢Ã¢â‚¬Å¡Ã‚Â¬Ãƒâ€šÃ‚Â ÃƒÆ’Ã†â€™Ãƒâ€šÃ‚Â¢ÃƒÆ’Ã‚Â¢ÃƒÂ¢Ã¢â€šÂ¬Ã…Â¡Ãƒâ€šÃ‚Â¬ÃƒÆ’Ã‚Â¢ÃƒÂ¢Ã¢â€šÂ¬Ã…Â¾Ãƒâ€šÃ‚Â¢ÃƒÆ’Ã†â€™Ãƒâ€ Ã¢â‚¬â„¢ÃƒÆ’Ã¢â‚¬Â ÃƒÂ¢Ã¢â€šÂ¬Ã¢â€žÂ¢ÃƒÆ’Ã†â€™Ãƒâ€šÃ‚Â¢ÃƒÆ’Ã‚Â¢ÃƒÂ¢Ã¢â€šÂ¬Ã…Â¡Ãƒâ€šÃ‚Â¬ÃƒÆ’Ã¢â‚¬Å¡Ãƒâ€šÃ‚Â ÃƒÆ’Ã†â€™Ãƒâ€ Ã¢â‚¬â„¢ÃƒÆ’Ã¢â‚¬Å¡Ãƒâ€šÃ‚Â¢ÃƒÆ’Ã†â€™Ãƒâ€šÃ‚Â¢ÃƒÆ’Ã‚Â¢ÃƒÂ¢Ã¢â‚¬Å¡Ã‚Â¬Ãƒâ€¦Ã‚Â¡ÃƒÆ’Ã¢â‚¬Å¡Ãƒâ€šÃ‚Â¬ÃƒÆ’Ã†â€™Ãƒâ€šÃ‚Â¢ÃƒÆ’Ã‚Â¢ÃƒÂ¢Ã¢â‚¬Å¡Ã‚Â¬Ãƒâ€¦Ã‚Â¾ÃƒÆ’Ã¢â‚¬Å¡Ãƒâ€šÃ‚Â¢ÃƒÆ’Ã†â€™Ãƒâ€ Ã¢â‚¬â„¢ÃƒÆ’Ã¢â‚¬Â ÃƒÂ¢Ã¢â€šÂ¬Ã¢â€žÂ¢ÃƒÆ’Ã†â€™ÃƒÂ¢Ã¢â€šÂ¬Ã‚Â ÃƒÆ’Ã‚Â¢ÃƒÂ¢Ã¢â‚¬Å¡Ã‚Â¬ÃƒÂ¢Ã¢â‚¬Å¾Ã‚Â¢ÃƒÆ’Ã†â€™Ãƒâ€ Ã¢â‚¬â„¢ÃƒÆ’Ã‚Â¢ÃƒÂ¢Ã¢â‚¬Å¡Ã‚Â¬Ãƒâ€¦Ã‚Â¡ÃƒÆ’Ã†â€™ÃƒÂ¢Ã¢â€šÂ¬Ã…Â¡ÃƒÆ’Ã¢â‚¬Å¡Ãƒâ€šÃ‚Â¢ÃƒÆ’Ã†â€™Ãƒâ€ Ã¢â‚¬â„¢ÃƒÆ’Ã¢â‚¬Â ÃƒÂ¢Ã¢â€šÂ¬Ã¢â€žÂ¢ÃƒÆ’Ã†â€™ÃƒÂ¢Ã¢â€šÂ¬Ã…Â¡ÃƒÆ’Ã¢â‚¬Å¡Ãƒâ€šÃ‚Â¢ÃƒÆ’Ã†â€™Ãƒâ€ Ã¢â‚¬â„¢ÃƒÆ’Ã¢â‚¬Å¡Ãƒâ€šÃ‚Â¢ÃƒÆ’Ã†â€™Ãƒâ€šÃ‚Â¢ÃƒÆ’Ã‚Â¢ÃƒÂ¢Ã¢â‚¬Å¡Ã‚Â¬Ãƒâ€¦Ã‚Â¡ÃƒÆ’Ã¢â‚¬Å¡Ãƒâ€šÃ‚Â¬ÃƒÆ’Ã†â€™ÃƒÂ¢Ã¢â€šÂ¬Ã‚Â¦ÃƒÆ’Ã¢â‚¬Å¡Ãƒâ€šÃ‚Â¡ÃƒÆ’Ã†â€™Ãƒâ€ Ã¢â‚¬â„¢ÃƒÆ’Ã‚Â¢ÃƒÂ¢Ã¢â‚¬Å¡Ã‚Â¬Ãƒâ€¦Ã‚Â¡ÃƒÆ’Ã†â€™ÃƒÂ¢Ã¢â€šÂ¬Ã…Â¡ÃƒÆ’Ã¢â‚¬Å¡Ãƒâ€šÃ‚Â¬ÃƒÆ’Ã†â€™Ãƒâ€ Ã¢â‚¬â„¢ÃƒÆ’Ã¢â‚¬Â ÃƒÂ¢Ã¢â€šÂ¬Ã¢â€žÂ¢ÃƒÆ’Ã†â€™Ãƒâ€šÃ‚Â¢ÃƒÆ’Ã‚Â¢ÃƒÂ¢Ã¢â€šÂ¬Ã…Â¡Ãƒâ€šÃ‚Â¬ÃƒÆ’Ã¢â‚¬Å¡Ãƒâ€šÃ‚Â¦ÃƒÆ’Ã†â€™Ãƒâ€ Ã¢â‚¬â„¢ÃƒÆ’Ã‚Â¢ÃƒÂ¢Ã¢â‚¬Å¡Ã‚Â¬Ãƒâ€¦Ã‚Â¡ÃƒÆ’Ã†â€™ÃƒÂ¢Ã¢â€šÂ¬Ã…Â¡ÃƒÆ’Ã¢â‚¬Å¡Ãƒâ€šÃ‚Â¡ÃƒÆ’Ã†â€™Ãƒâ€ Ã¢â‚¬â„¢ÃƒÆ’Ã¢â‚¬Â ÃƒÂ¢Ã¢â€šÂ¬Ã¢â€žÂ¢ÃƒÆ’Ã†â€™ÃƒÂ¢Ã¢â€šÂ¬Ã‚Â ÃƒÆ’Ã‚Â¢ÃƒÂ¢Ã¢â‚¬Å¡Ã‚Â¬ÃƒÂ¢Ã¢â‚¬Å¾Ã‚Â¢ÃƒÆ’Ã†â€™Ãƒâ€ Ã¢â‚¬â„¢ÃƒÆ’Ã‚Â¢ÃƒÂ¢Ã¢â‚¬Å¡Ã‚Â¬Ãƒâ€šÃ‚Â ÃƒÆ’Ã†â€™Ãƒâ€šÃ‚Â¢ÃƒÆ’Ã‚Â¢ÃƒÂ¢Ã¢â€šÂ¬Ã…Â¡Ãƒâ€šÃ‚Â¬ÃƒÆ’Ã‚Â¢ÃƒÂ¢Ã¢â€šÂ¬Ã…Â¾Ãƒâ€šÃ‚Â¢ÃƒÆ’Ã†â€™Ãƒâ€ Ã¢â‚¬â„¢ÃƒÆ’Ã¢â‚¬Â ÃƒÂ¢Ã¢â€šÂ¬Ã¢â€žÂ¢ÃƒÆ’Ã†â€™ÃƒÂ¢Ã¢â€šÂ¬Ã…Â¡ÃƒÆ’Ã¢â‚¬Å¡Ãƒâ€šÃ‚Â¢ÃƒÆ’Ã†â€™Ãƒâ€ Ã¢â‚¬â„¢ÃƒÆ’Ã¢â‚¬Å¡Ãƒâ€šÃ‚Â¢ÃƒÆ’Ã†â€™Ãƒâ€šÃ‚Â¢ÃƒÆ’Ã‚Â¢ÃƒÂ¢Ã¢â€šÂ¬Ã…Â¡Ãƒâ€šÃ‚Â¬ÃƒÆ’Ã¢â‚¬Â¦Ãƒâ€šÃ‚Â¡ÃƒÆ’Ã†â€™ÃƒÂ¢Ã¢â€šÂ¬Ã…Â¡ÃƒÆ’Ã¢â‚¬Å¡Ãƒâ€šÃ‚Â¬ÃƒÆ’Ã†â€™Ãƒâ€ Ã¢â‚¬â„¢ÃƒÆ’Ã‚Â¢ÃƒÂ¢Ã¢â‚¬Å¡Ã‚Â¬Ãƒâ€šÃ‚Â¦ÃƒÆ’Ã†â€™ÃƒÂ¢Ã¢â€šÂ¬Ã…Â¡ÃƒÆ’Ã¢â‚¬Å¡Ãƒâ€šÃ‚Â¡ÃƒÆ’Ã†â€™Ãƒâ€ Ã¢â‚¬â„¢ÃƒÆ’Ã¢â‚¬Â ÃƒÂ¢Ã¢â€šÂ¬Ã¢â€žÂ¢ÃƒÆ’Ã†â€™ÃƒÂ¢Ã¢â€šÂ¬Ã‚Â ÃƒÆ’Ã‚Â¢ÃƒÂ¢Ã¢â‚¬Å¡Ã‚Â¬ÃƒÂ¢Ã¢â‚¬Å¾Ã‚Â¢ÃƒÆ’Ã†â€™Ãƒâ€ Ã¢â‚¬â„¢ÃƒÆ’Ã¢â‚¬Å¡Ãƒâ€šÃ‚Â¢ÃƒÆ’Ã†â€™Ãƒâ€šÃ‚Â¢ÃƒÆ’Ã‚Â¢ÃƒÂ¢Ã¢â‚¬Å¡Ã‚Â¬Ãƒâ€¦Ã‚Â¡ÃƒÆ’Ã¢â‚¬Å¡Ãƒâ€šÃ‚Â¬ÃƒÆ’Ã†â€™ÃƒÂ¢Ã¢â€šÂ¬Ã‚Â¦ÃƒÆ’Ã¢â‚¬Å¡Ãƒâ€šÃ‚Â¡ÃƒÆ’Ã†â€™Ãƒâ€ Ã¢â‚¬â„¢ÃƒÆ’Ã¢â‚¬Â ÃƒÂ¢Ã¢â€šÂ¬Ã¢â€žÂ¢ÃƒÆ’Ã†â€™Ãƒâ€šÃ‚Â¢ÃƒÆ’Ã‚Â¢ÃƒÂ¢Ã¢â€šÂ¬Ã…Â¡Ãƒâ€šÃ‚Â¬ÃƒÆ’Ã¢â‚¬Â¦Ãƒâ€šÃ‚Â¡ÃƒÆ’Ã†â€™Ãƒâ€ Ã¢â‚¬â„¢ÃƒÆ’Ã‚Â¢ÃƒÂ¢Ã¢â‚¬Å¡Ã‚Â¬Ãƒâ€¦Ã‚Â¡ÃƒÆ’Ã†â€™ÃƒÂ¢Ã¢â€šÂ¬Ã…Â¡ÃƒÆ’Ã¢â‚¬Å¡Ãƒâ€šÃ‚Â¼g</w:t>
       </w:r>
       <w:proofErr w:type="spellEnd"/>
       <w:r>
@@ -8977,7 +8977,7 @@
           <w:sz w:val="28"/>
           <w:szCs w:val="28"/>
         </w:rPr>
-        <w:t>ÃƒÆ’Ã†â€™Ãƒâ€ Ã¢â‚¬â„¢ÃƒÆ’Ã¢â‚¬Â ÃƒÂ¢Ã¢â€šÂ¬Ã¢â€žÂ¢ÃƒÆ’Ã†â€™ÃƒÂ¢Ã¢â€šÂ¬Ã‚Â ÃƒÆ’Ã‚Â¢ÃƒÂ¢Ã¢â‚¬Å¡Ã‚Â¬ÃƒÂ¢Ã¢â‚¬Å¾Ã‚Â¢ÃƒÆ’Ã†â€™Ãƒâ€ Ã¢â‚¬â„¢ÃƒÆ’Ã‚Â¢ÃƒÂ¢Ã¢â‚¬Å¡Ã‚Â¬Ãƒâ€šÃ‚Â ÃƒÆ’Ã†â€™Ãƒâ€šÃ‚Â¢ÃƒÆ’Ã‚Â¢ÃƒÂ¢Ã¢â€šÂ¬Ã…Â¡Ãƒâ€šÃ‚Â¬ÃƒÆ’Ã‚Â¢ÃƒÂ¢Ã¢â€šÂ¬Ã…Â¾Ãƒâ€šÃ‚Â¢ÃƒÆ’Ã†â€™Ãƒâ€ Ã¢â‚¬â„¢ÃƒÆ’Ã¢â‚¬Â ÃƒÂ¢Ã¢â€šÂ¬Ã¢â€žÂ¢ÃƒÆ’Ã†â€™Ãƒâ€šÃ‚Â¢ÃƒÆ’Ã‚Â¢ÃƒÂ¢Ã¢â€šÂ¬Ã…Â¡Ãƒâ€šÃ‚Â¬ÃƒÆ’Ã¢â‚¬Å¡Ãƒâ€šÃ‚Â ÃƒÆ’Ã†â€™Ãƒâ€ Ã¢â‚¬â„¢ÃƒÆ’Ã¢â‚¬Å¡Ãƒâ€šÃ‚Â¢ÃƒÆ’Ã†â€™Ãƒâ€šÃ‚Â¢ÃƒÆ’Ã‚Â¢ÃƒÂ¢Ã¢â‚¬Å¡Ã‚Â¬Ãƒâ€¦Ã‚Â¡ÃƒÆ’Ã¢â‚¬Å¡Ãƒâ€šÃ‚Â¬ÃƒÆ’Ã†â€™Ãƒâ€šÃ‚Â¢ÃƒÆ’Ã‚Â¢ÃƒÂ¢Ã¢â‚¬Å¡Ã‚Â¬Ãƒâ€¦Ã‚Â¾ÃƒÆ’Ã¢â‚¬Å¡Ãƒâ€šÃ‚Â¢ÃƒÆ’Ã†â€™Ãƒâ€ Ã¢â‚¬â„¢ÃƒÆ’Ã¢â‚¬Â ÃƒÂ¢Ã¢â€šÂ¬Ã¢â€žÂ¢ÃƒÆ’Ã†â€™ÃƒÂ¢Ã¢â€šÂ¬Ã‚Â ÃƒÆ’Ã‚Â¢ÃƒÂ¢Ã¢â‚¬Å¡Ã‚Â¬ÃƒÂ¢Ã¢â‚¬Å¾Ã‚Â¢ÃƒÆ’Ã†â€™Ãƒâ€ Ã¢â‚¬â„¢ÃƒÆ’Ã¢â‚¬Å¡Ãƒâ€šÃ‚Â¢ÃƒÆ’Ã†â€™Ãƒâ€šÃ‚Â¢ÃƒÆ’Ã‚Â¢ÃƒÂ¢Ã¢â‚¬Å¡Ã‚Â¬Ãƒâ€¦Ã‚Â¡ÃƒÆ’Ã¢â‚¬Å¡Ãƒâ€šÃ‚Â¬ÃƒÆ’Ã†â€™ÃƒÂ¢Ã¢â€šÂ¬Ã…Â¡ÃƒÆ’Ã¢â‚¬Å¡Ãƒâ€šÃ‚Â¦ÃƒÆ’Ã†â€™Ãƒâ€ Ã¢â‚¬â„¢ÃƒÆ’Ã¢â‚¬Â ÃƒÂ¢Ã¢â€šÂ¬Ã¢â€žÂ¢ÃƒÆ’Ã†â€™Ãƒâ€šÃ‚Â¢ÃƒÆ’Ã‚Â¢ÃƒÂ¢Ã¢â€šÂ¬Ã…Â¡Ãƒâ€šÃ‚Â¬ÃƒÆ’Ã¢â‚¬Â¦Ãƒâ€šÃ‚Â¡ÃƒÆ’Ã†â€™Ãƒâ€ Ã¢â‚¬â„¢ÃƒÆ’Ã‚Â¢ÃƒÂ¢Ã¢â‚¬Å¡Ã‚Â¬Ãƒâ€¦Ã‚Â¡ÃƒÆ’Ã†â€™ÃƒÂ¢Ã¢â€šÂ¬Ã…Â¡ÃƒÆ’Ã¢â‚¬Å¡Ãƒâ€šÃ‚Â½ÃƒÆ’Ã†â€™Ãƒâ€ Ã¢â‚¬â„¢ÃƒÆ’Ã¢â‚¬Â ÃƒÂ¢Ã¢â€šÂ¬Ã¢â€žÂ¢ÃƒÆ’Ã†â€™ÃƒÂ¢Ã¢â€šÂ¬Ã‚Â ÃƒÆ’Ã‚Â¢ÃƒÂ¢Ã¢â‚¬Å¡Ã‚Â¬ÃƒÂ¢Ã¢â‚¬Å¾Ã‚Â¢ÃƒÆ’Ã†â€™Ãƒâ€ Ã¢â‚¬â„¢ÃƒÆ’Ã‚Â¢ÃƒÂ¢Ã¢â‚¬Å¡Ã‚Â¬Ãƒâ€šÃ‚Â ÃƒÆ’Ã†â€™Ãƒâ€šÃ‚Â¢ÃƒÆ’Ã‚Â¢ÃƒÂ¢Ã¢â€šÂ¬Ã…Â¡Ãƒâ€šÃ‚Â¬ÃƒÆ’Ã‚Â¢ÃƒÂ¢Ã¢â€šÂ¬Ã…Â¾Ãƒâ€šÃ‚Â¢ÃƒÆ’Ã†â€™Ãƒâ€ Ã¢â‚¬â„¢ÃƒÆ’Ã¢â‚¬Â ÃƒÂ¢Ã¢â€šÂ¬Ã¢â€žÂ¢ÃƒÆ’Ã†â€™ÃƒÂ¢Ã¢â€šÂ¬Ã…Â¡ÃƒÆ’Ã¢â‚¬Å¡Ãƒâ€šÃ‚Â¢ÃƒÆ’Ã†â€™Ãƒâ€ Ã¢â‚¬â„¢ÃƒÆ’Ã¢â‚¬Å¡Ãƒâ€šÃ‚Â¢ÃƒÆ’Ã†â€™Ãƒâ€šÃ‚Â¢ÃƒÆ’Ã‚Â¢ÃƒÂ¢Ã¢â€šÂ¬Ã…Â¡Ãƒâ€šÃ‚Â¬ÃƒÆ’Ã¢â‚¬Â¦Ãƒâ€šÃ‚Â¡ÃƒÆ’Ã†â€™ÃƒÂ¢Ã¢â€šÂ¬Ã…Â¡ÃƒÆ’Ã¢â‚¬Å¡Ãƒâ€šÃ‚Â¬ÃƒÆ’Ã†â€™Ãƒâ€ Ã¢â‚¬â„¢ÃƒÆ’Ã‚Â¢ÃƒÂ¢Ã¢â‚¬Å¡Ã‚Â¬Ãƒâ€šÃ‚Â¦ÃƒÆ’Ã†â€™ÃƒÂ¢Ã¢â€šÂ¬Ã…Â¡ÃƒÆ’Ã¢â‚¬Å¡Ãƒâ€šÃ‚Â¡ÃƒÆ’Ã†â€™Ãƒâ€ Ã¢â‚¬â„¢ÃƒÆ’Ã¢â‚¬Â ÃƒÂ¢Ã¢â€šÂ¬Ã¢â€žÂ¢ÃƒÆ’Ã†â€™ÃƒÂ¢Ã¢â€šÂ¬Ã‚Â ÃƒÆ’Ã‚Â¢ÃƒÂ¢Ã¢â‚¬Å¡Ã‚Â¬ÃƒÂ¢Ã¢â‚¬Å¾Ã‚Â¢ÃƒÆ’Ã†â€™Ãƒâ€ Ã¢â‚¬â„¢ÃƒÆ’Ã¢â‚¬Å¡Ãƒâ€šÃ‚Â¢ÃƒÆ’Ã†â€™Ãƒâ€šÃ‚Â¢ÃƒÆ’Ã‚Â¢ÃƒÂ¢Ã¢â‚¬Å¡Ã‚Â¬Ãƒâ€¦Ã‚Â¡ÃƒÆ’Ã¢â‚¬Å¡Ãƒâ€šÃ‚Â¬ÃƒÆ’Ã†â€™ÃƒÂ¢Ã¢â€šÂ¬Ã‚Â¦ÃƒÆ’Ã¢â‚¬Å¡Ãƒâ€šÃ‚Â¡ÃƒÆ’Ã†â€™Ãƒâ€ Ã¢â‚¬â„¢ÃƒÆ’Ã¢â‚¬Â ÃƒÂ¢Ã¢â€šÂ¬Ã¢â€žÂ¢ÃƒÆ’Ã†â€™Ãƒâ€šÃ‚Â¢ÃƒÆ’Ã‚Â¢ÃƒÂ¢Ã¢â€šÂ¬Ã…Â¡Ãƒâ€šÃ‚Â¬ÃƒÆ’Ã¢â‚¬Â¦Ãƒâ€šÃ‚Â¡ÃƒÆ’Ã†â€™Ãƒâ€ Ã¢â‚¬â„¢ÃƒÆ’Ã‚Â¢ÃƒÂ¢Ã¢â‚¬Å¡Ã‚Â¬Ãƒâ€¦Ã‚Â¡ÃƒÆ’Ã†â€™ÃƒÂ¢Ã¢â€šÂ¬Ã…Â¡ÃƒÆ’Ã¢â‚¬Å¡Ãƒâ€šÃ‚Â¼g</w:t>
+        <w:t>ÃƒÆ’Ã†â€™Ãƒâ€ Ã¢â‚¬â„¢ÃƒÆ’Ã¢â‚¬Â ÃƒÂ¢Ã¢â€šÂ¬Ã¢â€žÂ¢ÃƒÆ’Ã†â€™ÃƒÂ¢Ã¢â€šÂ¬Ã‚Â ÃƒÆ’Ã‚Â¢ÃƒÂ¢Ã¢â‚¬Å¡Ã‚Â¬ÃƒÂ¢Ã¢â‚¬Å¾Ã‚Â¢ÃƒÆ’Ã†â€™Ãƒâ€ Ã¢â‚¬â„¢ÃƒÆ’Ã‚Â¢ÃƒÂ¢Ã¢â‚¬Å¡Ã‚Â¬Ãƒâ€šÃ‚Â ÃƒÆ’Ã†â€™Ãƒâ€šÃ‚Â¢ÃƒÆ’Ã‚Â¢ÃƒÂ¢Ã¢â€šÂ¬Ã…Â¡Ãƒâ€šÃ‚Â¬ÃƒÆ’Ã‚Â¢ÃƒÂ¢Ã¢â€šÂ¬Ã…Â¾Ãƒâ€šÃ‚Â¢ÃƒÆ’Ã†â€™Ãƒâ€ Ã¢â‚¬â„¢ÃƒÆ’Ã¢â‚¬Â ÃƒÂ¢Ã¢â€šÂ¬Ã¢â€žÂ¢ÃƒÆ’Ã†â€™Ãƒâ€šÃ‚Â¢ÃƒÆ’Ã‚Â¢ÃƒÂ¢Ã¢â€šÂ¬Ã…Â¡Ãƒâ€šÃ‚Â¬ÃƒÆ’Ã¢â‚¬Å¡Ãƒâ€šÃ‚Â ÃƒÆ’Ã†â€™Ãƒâ€ Ã¢â‚¬â„¢ÃƒÆ’Ã¢â‚¬Å¡Ãƒâ€šÃ‚Â¢ÃƒÆ’Ã†â€™Ãƒâ€šÃ‚Â¢ÃƒÆ’Ã‚Â¢ÃƒÂ¢Ã¢â‚¬Å¡Ã‚Â¬Ãƒâ€¦Ã‚Â¡ÃƒÆ’Ã¢â‚¬Å¡Ãƒâ€šÃ‚Â¬ÃƒÆ’Ã†â€™Ãƒâ€šÃ‚Â¢ÃƒÆ’Ã‚Â¢ÃƒÂ¢Ã¢â‚¬Å¡Ã‚Â¬Ãƒâ€¦Ã‚Â¾ÃƒÆ’Ã¢â‚¬Å¡Ãƒâ€šÃ‚Â¢ÃƒÆ’Ã†â€™Ãƒâ€ Ã¢â‚¬â„¢ÃƒÆ’Ã¢â‚¬Â ÃƒÂ¢Ã¢â€šÂ¬Ã¢â€žÂ¢ÃƒÆ’Ã†â€™ÃƒÂ¢Ã¢â€šÂ¬Ã‚Â ÃƒÆ’Ã‚Â¢ÃƒÂ¢Ã¢â‚¬Å¡Ã‚Â¬ÃƒÂ¢Ã¢â‚¬Å¾Ã‚Â¢ÃƒÆ’Ã†â€™Ãƒâ€ Ã¢â‚¬â„¢ÃƒÆ’Ã¢â‚¬Å¡Ãƒâ€šÃ‚Â¢ÃƒÆ’Ã†â€™Ãƒâ€šÃ‚Â¢ÃƒÆ’Ã‚Â¢ÃƒÂ¢Ã¢â‚¬Å¡Ã‚Â¬Ãƒâ€¦Ã‚Â¡ÃƒÆ’Ã¢â‚¬Å¡Ãƒâ€šÃ‚Â¬ÃƒÆ’Ã†â€™ÃƒÂ¢Ã¢â€šÂ¬Ã…Â¡ÃƒÆ’Ã¢â‚¬Å¡Ãƒâ€šÃ‚Â ÃƒÆ’Ã†â€™Ãƒâ€ Ã¢â‚¬â„¢ÃƒÆ’Ã¢â‚¬Â ÃƒÂ¢Ã¢â€šÂ¬Ã¢â€žÂ¢ÃƒÆ’Ã†â€™ÃƒÂ¢Ã¢â€šÂ¬Ã…Â¡ÃƒÆ’Ã¢â‚¬Å¡Ãƒâ€šÃ‚Â¢ÃƒÆ’Ã†â€™Ãƒâ€ Ã¢â‚¬â„¢ÃƒÆ’Ã¢â‚¬Å¡Ãƒâ€šÃ‚Â¢ÃƒÆ’Ã†â€™Ãƒâ€šÃ‚Â¢ÃƒÆ’Ã‚Â¢ÃƒÂ¢Ã¢â€šÂ¬Ã…Â¡Ãƒâ€šÃ‚Â¬ÃƒÆ’Ã¢â‚¬Â¦Ãƒâ€šÃ‚Â¡ÃƒÆ’Ã†â€™ÃƒÂ¢Ã¢â€šÂ¬Ã…Â¡ÃƒÆ’Ã¢â‚¬Å¡Ãƒâ€šÃ‚Â¬ÃƒÆ’Ã†â€™Ãƒâ€ Ã¢â‚¬â„¢ÃƒÆ’Ã¢â‚¬Å¡Ãƒâ€šÃ‚Â¢ÃƒÆ’Ã†â€™Ãƒâ€šÃ‚Â¢ÃƒÆ’Ã‚Â¢ÃƒÂ¢Ã¢â€šÂ¬Ã…Â¡Ãƒâ€šÃ‚Â¬ÃƒÆ’Ã¢â‚¬Â¦Ãƒâ€šÃ‚Â¾ÃƒÆ’Ã†â€™ÃƒÂ¢Ã¢â€šÂ¬Ã…Â¡ÃƒÆ’Ã¢â‚¬Å¡Ãƒâ€šÃ‚Â¢ÃƒÆ’Ã†â€™Ãƒâ€ Ã¢â‚¬â„¢ÃƒÆ’Ã¢â‚¬Â ÃƒÂ¢Ã¢â€šÂ¬Ã¢â€žÂ¢ÃƒÆ’Ã†â€™ÃƒÂ¢Ã¢â€šÂ¬Ã‚Â ÃƒÆ’Ã‚Â¢ÃƒÂ¢Ã¢â‚¬Å¡Ã‚Â¬ÃƒÂ¢Ã¢â‚¬Å¾Ã‚Â¢ÃƒÆ’Ã†â€™Ãƒâ€ Ã¢â‚¬â„¢ÃƒÆ’Ã‚Â¢ÃƒÂ¢Ã¢â‚¬Å¡Ã‚Â¬Ãƒâ€šÃ‚Â ÃƒÆ’Ã†â€™Ãƒâ€šÃ‚Â¢ÃƒÆ’Ã‚Â¢ÃƒÂ¢Ã¢â€šÂ¬Ã…Â¡Ãƒâ€šÃ‚Â¬ÃƒÆ’Ã‚Â¢ÃƒÂ¢Ã¢â€šÂ¬Ã…Â¾Ãƒâ€šÃ‚Â¢ÃƒÆ’Ã†â€™Ãƒâ€ Ã¢â‚¬â„¢ÃƒÆ’Ã¢â‚¬Â ÃƒÂ¢Ã¢â€šÂ¬Ã¢â€žÂ¢ÃƒÆ’Ã†â€™ÃƒÂ¢Ã¢â€šÂ¬Ã…Â¡ÃƒÆ’Ã¢â‚¬Å¡Ãƒâ€šÃ‚Â¢ÃƒÆ’Ã†â€™Ãƒâ€ Ã¢â‚¬â„¢ÃƒÆ’Ã¢â‚¬Å¡Ãƒâ€šÃ‚Â¢ÃƒÆ’Ã†â€™Ãƒâ€šÃ‚Â¢ÃƒÆ’Ã‚Â¢ÃƒÂ¢Ã¢â€šÂ¬Ã…Â¡Ãƒâ€šÃ‚Â¬ÃƒÆ’Ã¢â‚¬Â¦Ãƒâ€šÃ‚Â¡ÃƒÆ’Ã†â€™ÃƒÂ¢Ã¢â€šÂ¬Ã…Â¡ÃƒÆ’Ã¢â‚¬Å¡Ãƒâ€šÃ‚Â¬ÃƒÆ’Ã†â€™Ãƒâ€ Ã¢â‚¬â„¢ÃƒÆ’Ã‚Â¢ÃƒÂ¢Ã¢â‚¬Å¡Ã‚Â¬Ãƒâ€¦Ã‚Â¡ÃƒÆ’Ã†â€™ÃƒÂ¢Ã¢â€šÂ¬Ã…Â¡ÃƒÆ’Ã¢â‚¬Å¡Ãƒâ€šÃ‚Â¦ÃƒÆ’Ã†â€™Ãƒâ€ Ã¢â‚¬â„¢ÃƒÆ’Ã¢â‚¬Â ÃƒÂ¢Ã¢â€šÂ¬Ã¢â€žÂ¢ÃƒÆ’Ã†â€™ÃƒÂ¢Ã¢â€šÂ¬Ã‚Â ÃƒÆ’Ã‚Â¢ÃƒÂ¢Ã¢â‚¬Å¡Ã‚Â¬ÃƒÂ¢Ã¢â‚¬Å¾Ã‚Â¢ÃƒÆ’Ã†â€™Ãƒâ€ Ã¢â‚¬â„¢ÃƒÆ’Ã¢â‚¬Å¡Ãƒâ€šÃ‚Â¢ÃƒÆ’Ã†â€™Ãƒâ€šÃ‚Â¢ÃƒÆ’Ã‚Â¢ÃƒÂ¢Ã¢â‚¬Å¡Ã‚Â¬Ãƒâ€¦Ã‚Â¡ÃƒÆ’Ã¢â‚¬Å¡Ãƒâ€šÃ‚Â¬ÃƒÆ’Ã†â€™ÃƒÂ¢Ã¢â€šÂ¬Ã‚Â¦ÃƒÆ’Ã¢â‚¬Å¡Ãƒâ€šÃ‚Â¡ÃƒÆ’Ã†â€™Ãƒâ€ Ã¢â‚¬â„¢ÃƒÆ’Ã¢â‚¬Â ÃƒÂ¢Ã¢â€šÂ¬Ã¢â€žÂ¢ÃƒÆ’Ã†â€™Ãƒâ€šÃ‚Â¢ÃƒÆ’Ã‚Â¢ÃƒÂ¢Ã¢â€šÂ¬Ã…Â¡Ãƒâ€šÃ‚Â¬ÃƒÆ’Ã¢â‚¬Â¦Ãƒâ€šÃ‚Â¡ÃƒÆ’Ã†â€™Ãƒâ€ Ã¢â‚¬â„¢ÃƒÆ’Ã‚Â¢ÃƒÂ¢Ã¢â‚¬Å¡Ã‚Â¬Ãƒâ€¦Ã‚Â¡ÃƒÆ’Ã†â€™ÃƒÂ¢Ã¢â€šÂ¬Ã…Â¡ÃƒÆ’Ã¢â‚¬Å¡Ãƒâ€šÃ‚Â½ÃƒÆ’Ã†â€™Ãƒâ€ Ã¢â‚¬â„¢ÃƒÆ’Ã¢â‚¬Â ÃƒÂ¢Ã¢â€šÂ¬Ã¢â€žÂ¢ÃƒÆ’Ã†â€™ÃƒÂ¢Ã¢â€šÂ¬Ã‚Â ÃƒÆ’Ã‚Â¢ÃƒÂ¢Ã¢â‚¬Å¡Ã‚Â¬ÃƒÂ¢Ã¢â‚¬Å¾Ã‚Â¢ÃƒÆ’Ã†â€™Ãƒâ€ Ã¢â‚¬â„¢ÃƒÆ’Ã‚Â¢ÃƒÂ¢Ã¢â‚¬Å¡Ã‚Â¬Ãƒâ€šÃ‚Â ÃƒÆ’Ã†â€™Ãƒâ€šÃ‚Â¢ÃƒÆ’Ã‚Â¢ÃƒÂ¢Ã¢â€šÂ¬Ã…Â¡Ãƒâ€šÃ‚Â¬ÃƒÆ’Ã‚Â¢ÃƒÂ¢Ã¢â€šÂ¬Ã…Â¾Ãƒâ€šÃ‚Â¢ÃƒÆ’Ã†â€™Ãƒâ€ Ã¢â‚¬â„¢ÃƒÆ’Ã¢â‚¬Â ÃƒÂ¢Ã¢â€šÂ¬Ã¢â€žÂ¢ÃƒÆ’Ã†â€™Ãƒâ€šÃ‚Â¢ÃƒÆ’Ã‚Â¢ÃƒÂ¢Ã¢â€šÂ¬Ã…Â¡Ãƒâ€šÃ‚Â¬ÃƒÆ’Ã¢â‚¬Å¡Ãƒâ€šÃ‚Â ÃƒÆ’Ã†â€™Ãƒâ€ Ã¢â‚¬â„¢ÃƒÆ’Ã¢â‚¬Å¡Ãƒâ€šÃ‚Â¢ÃƒÆ’Ã†â€™Ãƒâ€šÃ‚Â¢ÃƒÆ’Ã‚Â¢ÃƒÂ¢Ã¢â‚¬Å¡Ã‚Â¬Ãƒâ€¦Ã‚Â¡ÃƒÆ’Ã¢â‚¬Å¡Ãƒâ€šÃ‚Â¬ÃƒÆ’Ã†â€™Ãƒâ€šÃ‚Â¢ÃƒÆ’Ã‚Â¢ÃƒÂ¢Ã¢â‚¬Å¡Ã‚Â¬Ãƒâ€¦Ã‚Â¾ÃƒÆ’Ã¢â‚¬Å¡Ãƒâ€šÃ‚Â¢ÃƒÆ’Ã†â€™Ãƒâ€ Ã¢â‚¬â„¢ÃƒÆ’Ã¢â‚¬Â ÃƒÂ¢Ã¢â€šÂ¬Ã¢â€žÂ¢ÃƒÆ’Ã†â€™ÃƒÂ¢Ã¢â€šÂ¬Ã‚Â ÃƒÆ’Ã‚Â¢ÃƒÂ¢Ã¢â‚¬Å¡Ã‚Â¬ÃƒÂ¢Ã¢â‚¬Å¾Ã‚Â¢ÃƒÆ’Ã†â€™Ãƒâ€ Ã¢â‚¬â„¢ÃƒÆ’Ã‚Â¢ÃƒÂ¢Ã¢â‚¬Å¡Ã‚Â¬Ãƒâ€¦Ã‚Â¡ÃƒÆ’Ã†â€™ÃƒÂ¢Ã¢â€šÂ¬Ã…Â¡ÃƒÆ’Ã¢â‚¬Å¡Ãƒâ€šÃ‚Â¢ÃƒÆ’Ã†â€™Ãƒâ€ Ã¢â‚¬â„¢ÃƒÆ’Ã¢â‚¬Â ÃƒÂ¢Ã¢â€šÂ¬Ã¢â€žÂ¢ÃƒÆ’Ã†â€™ÃƒÂ¢Ã¢â€šÂ¬Ã…Â¡ÃƒÆ’Ã¢â‚¬Å¡Ãƒâ€šÃ‚Â¢ÃƒÆ’Ã†â€™Ãƒâ€ Ã¢â‚¬â„¢ÃƒÆ’Ã¢â‚¬Å¡Ãƒâ€šÃ‚Â¢ÃƒÆ’Ã†â€™Ãƒâ€šÃ‚Â¢ÃƒÆ’Ã‚Â¢ÃƒÂ¢Ã¢â‚¬Å¡Ã‚Â¬Ãƒâ€¦Ã‚Â¡ÃƒÆ’Ã¢â‚¬Å¡Ãƒâ€šÃ‚Â¬ÃƒÆ’Ã†â€™ÃƒÂ¢Ã¢â€šÂ¬Ã‚Â¦ÃƒÆ’Ã¢â‚¬Å¡Ãƒâ€šÃ‚Â¡ÃƒÆ’Ã†â€™Ãƒâ€ Ã¢â‚¬â„¢ÃƒÆ’Ã‚Â¢ÃƒÂ¢Ã¢â‚¬Å¡Ã‚Â¬Ãƒâ€¦Ã‚Â¡ÃƒÆ’Ã†â€™ÃƒÂ¢Ã¢â€šÂ¬Ã…Â¡ÃƒÆ’Ã¢â‚¬Å¡Ãƒâ€šÃ‚Â¬ÃƒÆ’Ã†â€™Ãƒâ€ Ã¢â‚¬â„¢ÃƒÆ’Ã¢â‚¬Â ÃƒÂ¢Ã¢â€šÂ¬Ã¢â€žÂ¢ÃƒÆ’Ã†â€™Ãƒâ€šÃ‚Â¢ÃƒÆ’Ã‚Â¢ÃƒÂ¢Ã¢â€šÂ¬Ã…Â¡Ãƒâ€šÃ‚Â¬ÃƒÆ’Ã¢â‚¬Å¡Ãƒâ€šÃ‚Â¦ÃƒÆ’Ã†â€™Ãƒâ€ Ã¢â‚¬â„¢ÃƒÆ’Ã‚Â¢ÃƒÂ¢Ã¢â‚¬Å¡Ã‚Â¬Ãƒâ€¦Ã‚Â¡ÃƒÆ’Ã†â€™ÃƒÂ¢Ã¢â€šÂ¬Ã…Â¡ÃƒÆ’Ã¢â‚¬Å¡Ãƒâ€šÃ‚Â¡ÃƒÆ’Ã†â€™Ãƒâ€ Ã¢â‚¬â„¢ÃƒÆ’Ã¢â‚¬Â ÃƒÂ¢Ã¢â€šÂ¬Ã¢â€žÂ¢ÃƒÆ’Ã†â€™ÃƒÂ¢Ã¢â€šÂ¬Ã‚Â ÃƒÆ’Ã‚Â¢ÃƒÂ¢Ã¢â‚¬Å¡Ã‚Â¬ÃƒÂ¢Ã¢â‚¬Å¾Ã‚Â¢ÃƒÆ’Ã†â€™Ãƒâ€ Ã¢â‚¬â„¢ÃƒÆ’Ã‚Â¢ÃƒÂ¢Ã¢â‚¬Å¡Ã‚Â¬Ãƒâ€šÃ‚Â ÃƒÆ’Ã†â€™Ãƒâ€šÃ‚Â¢ÃƒÆ’Ã‚Â¢ÃƒÂ¢Ã¢â€šÂ¬Ã…Â¡Ãƒâ€šÃ‚Â¬ÃƒÆ’Ã‚Â¢ÃƒÂ¢Ã¢â€šÂ¬Ã…Â¾Ãƒâ€šÃ‚Â¢ÃƒÆ’Ã†â€™Ãƒâ€ Ã¢â‚¬â„¢ÃƒÆ’Ã¢â‚¬Â ÃƒÂ¢Ã¢â€šÂ¬Ã¢â€žÂ¢ÃƒÆ’Ã†â€™ÃƒÂ¢Ã¢â€šÂ¬Ã…Â¡ÃƒÆ’Ã¢â‚¬Å¡Ãƒâ€šÃ‚Â¢ÃƒÆ’Ã†â€™Ãƒâ€ Ã¢â‚¬â„¢ÃƒÆ’Ã¢â‚¬Å¡Ãƒâ€šÃ‚Â¢ÃƒÆ’Ã†â€™Ãƒâ€šÃ‚Â¢ÃƒÆ’Ã‚Â¢ÃƒÂ¢Ã¢â€šÂ¬Ã…Â¡Ãƒâ€šÃ‚Â¬ÃƒÆ’Ã¢â‚¬Â¦Ãƒâ€šÃ‚Â¡ÃƒÆ’Ã†â€™ÃƒÂ¢Ã¢â€šÂ¬Ã…Â¡ÃƒÆ’Ã¢â‚¬Å¡Ãƒâ€šÃ‚Â¬ÃƒÆ’Ã†â€™Ãƒâ€ Ã¢â‚¬â„¢ÃƒÆ’Ã‚Â¢ÃƒÂ¢Ã¢â‚¬Å¡Ã‚Â¬Ãƒâ€šÃ‚Â¦ÃƒÆ’Ã†â€™ÃƒÂ¢Ã¢â€šÂ¬Ã…Â¡ÃƒÆ’Ã¢â‚¬Å¡Ãƒâ€šÃ‚Â¡ÃƒÆ’Ã†â€™Ãƒâ€ Ã¢â‚¬â„¢ÃƒÆ’Ã¢â‚¬Â ÃƒÂ¢Ã¢â€šÂ¬Ã¢â€žÂ¢ÃƒÆ’Ã†â€™ÃƒÂ¢Ã¢â€šÂ¬Ã‚Â ÃƒÆ’Ã‚Â¢ÃƒÂ¢Ã¢â‚¬Å¡Ã‚Â¬ÃƒÂ¢Ã¢â‚¬Å¾Ã‚Â¢ÃƒÆ’Ã†â€™Ãƒâ€ Ã¢â‚¬â„¢ÃƒÆ’Ã¢â‚¬Å¡Ãƒâ€šÃ‚Â¢ÃƒÆ’Ã†â€™Ãƒâ€šÃ‚Â¢ÃƒÆ’Ã‚Â¢ÃƒÂ¢Ã¢â‚¬Å¡Ã‚Â¬Ãƒâ€¦Ã‚Â¡ÃƒÆ’Ã¢â‚¬Å¡Ãƒâ€šÃ‚Â¬ÃƒÆ’Ã†â€™ÃƒÂ¢Ã¢â€šÂ¬Ã‚Â¦ÃƒÆ’Ã¢â‚¬Å¡Ãƒâ€šÃ‚Â¡ÃƒÆ’Ã†â€™Ãƒâ€ Ã¢â‚¬â„¢ÃƒÆ’Ã¢â‚¬Â ÃƒÂ¢Ã¢â€šÂ¬Ã¢â€žÂ¢ÃƒÆ’Ã†â€™Ãƒâ€šÃ‚Â¢ÃƒÆ’Ã‚Â¢ÃƒÂ¢Ã¢â€šÂ¬Ã…Â¡Ãƒâ€šÃ‚Â¬ÃƒÆ’Ã¢â‚¬Â¦Ãƒâ€šÃ‚Â¡ÃƒÆ’Ã†â€™Ãƒâ€ Ã¢â‚¬â„¢ÃƒÆ’Ã‚Â¢ÃƒÂ¢Ã¢â‚¬Å¡Ã‚Â¬Ãƒâ€¦Ã‚Â¡ÃƒÆ’Ã†â€™ÃƒÂ¢Ã¢â€šÂ¬Ã…Â¡ÃƒÆ’Ã¢â‚¬Å¡Ãƒâ€šÃ‚Â¼g</w:t>
       </w:r>
       <w:proofErr w:type="spellEnd"/>
       <w:r>
@@ -9134,7 +9134,7 @@
           <w:sz w:val="28"/>
           <w:szCs w:val="28"/>
         </w:rPr>
-        <w:t>ÃƒÆ’Ã†â€™Ãƒâ€ Ã¢â‚¬â„¢ÃƒÆ’Ã¢â‚¬Â ÃƒÂ¢Ã¢â€šÂ¬Ã¢â€žÂ¢ÃƒÆ’Ã†â€™ÃƒÂ¢Ã¢â€šÂ¬Ã‚Â ÃƒÆ’Ã‚Â¢ÃƒÂ¢Ã¢â‚¬Å¡Ã‚Â¬ÃƒÂ¢Ã¢â‚¬Å¾Ã‚Â¢ÃƒÆ’Ã†â€™Ãƒâ€ Ã¢â‚¬â„¢ÃƒÆ’Ã‚Â¢ÃƒÂ¢Ã¢â‚¬Å¡Ã‚Â¬Ãƒâ€šÃ‚Â ÃƒÆ’Ã†â€™Ãƒâ€šÃ‚Â¢ÃƒÆ’Ã‚Â¢ÃƒÂ¢Ã¢â€šÂ¬Ã…Â¡Ãƒâ€šÃ‚Â¬ÃƒÆ’Ã‚Â¢ÃƒÂ¢Ã¢â€šÂ¬Ã…Â¾Ãƒâ€šÃ‚Â¢ÃƒÆ’Ã†â€™Ãƒâ€ Ã¢â‚¬â„¢ÃƒÆ’Ã¢â‚¬Â ÃƒÂ¢Ã¢â€šÂ¬Ã¢â€žÂ¢ÃƒÆ’Ã†â€™Ãƒâ€šÃ‚Â¢ÃƒÆ’Ã‚Â¢ÃƒÂ¢Ã¢â€šÂ¬Ã…Â¡Ãƒâ€šÃ‚Â¬ÃƒÆ’Ã¢â‚¬Å¡Ãƒâ€šÃ‚Â ÃƒÆ’Ã†â€™Ãƒâ€ Ã¢â‚¬â„¢ÃƒÆ’Ã¢â‚¬Å¡Ãƒâ€šÃ‚Â¢ÃƒÆ’Ã†â€™Ãƒâ€šÃ‚Â¢ÃƒÆ’Ã‚Â¢ÃƒÂ¢Ã¢â‚¬Å¡Ã‚Â¬Ãƒâ€¦Ã‚Â¡ÃƒÆ’Ã¢â‚¬Å¡Ãƒâ€šÃ‚Â¬ÃƒÆ’Ã†â€™Ãƒâ€šÃ‚Â¢ÃƒÆ’Ã‚Â¢ÃƒÂ¢Ã¢â‚¬Å¡Ã‚Â¬Ãƒâ€¦Ã‚Â¾ÃƒÆ’Ã¢â‚¬Å¡Ãƒâ€šÃ‚Â¢ÃƒÆ’Ã†â€™Ãƒâ€ Ã¢â‚¬â„¢ÃƒÆ’Ã¢â‚¬Â ÃƒÂ¢Ã¢â€šÂ¬Ã¢â€žÂ¢ÃƒÆ’Ã†â€™ÃƒÂ¢Ã¢â€šÂ¬Ã‚Â ÃƒÆ’Ã‚Â¢ÃƒÂ¢Ã¢â‚¬Å¡Ã‚Â¬ÃƒÂ¢Ã¢â‚¬Å¾Ã‚Â¢ÃƒÆ’Ã†â€™Ãƒâ€ Ã¢â‚¬â„¢ÃƒÆ’Ã¢â‚¬Å¡Ãƒâ€šÃ‚Â¢ÃƒÆ’Ã†â€™Ãƒâ€šÃ‚Â¢ÃƒÆ’Ã‚Â¢ÃƒÂ¢Ã¢â‚¬Å¡Ã‚Â¬Ãƒâ€¦Ã‚Â¡ÃƒÆ’Ã¢â‚¬Å¡Ãƒâ€šÃ‚Â¬ÃƒÆ’Ã†â€™ÃƒÂ¢Ã¢â€šÂ¬Ã…Â¡ÃƒÆ’Ã¢â‚¬Å¡Ãƒâ€šÃ‚Â¦ÃƒÆ’Ã†â€™Ãƒâ€ Ã¢â‚¬â„¢ÃƒÆ’Ã¢â‚¬Â ÃƒÂ¢Ã¢â€šÂ¬Ã¢â€žÂ¢ÃƒÆ’Ã†â€™Ãƒâ€šÃ‚Â¢ÃƒÆ’Ã‚Â¢ÃƒÂ¢Ã¢â€šÂ¬Ã…Â¡Ãƒâ€šÃ‚Â¬ÃƒÆ’Ã¢â‚¬Â¦Ãƒâ€šÃ‚Â¡ÃƒÆ’Ã†â€™Ãƒâ€ Ã¢â‚¬â„¢ÃƒÆ’Ã‚Â¢ÃƒÂ¢Ã¢â‚¬Å¡Ã‚Â¬Ãƒâ€¦Ã‚Â¡ÃƒÆ’Ã†â€™ÃƒÂ¢Ã¢â€šÂ¬Ã…Â¡ÃƒÆ’Ã¢â‚¬Å¡Ãƒâ€šÃ‚Â½ÃƒÆ’Ã†â€™Ãƒâ€ Ã¢â‚¬â„¢ÃƒÆ’Ã¢â‚¬Â ÃƒÂ¢Ã¢â€šÂ¬Ã¢â€žÂ¢ÃƒÆ’Ã†â€™ÃƒÂ¢Ã¢â€šÂ¬Ã‚Â ÃƒÆ’Ã‚Â¢ÃƒÂ¢Ã¢â‚¬Å¡Ã‚Â¬ÃƒÂ¢Ã¢â‚¬Å¾Ã‚Â¢ÃƒÆ’Ã†â€™Ãƒâ€ Ã¢â‚¬â„¢ÃƒÆ’Ã‚Â¢ÃƒÂ¢Ã¢â‚¬Å¡Ã‚Â¬Ãƒâ€šÃ‚Â ÃƒÆ’Ã†â€™Ãƒâ€šÃ‚Â¢ÃƒÆ’Ã‚Â¢ÃƒÂ¢Ã¢â€šÂ¬Ã…Â¡Ãƒâ€šÃ‚Â¬ÃƒÆ’Ã‚Â¢ÃƒÂ¢Ã¢â€šÂ¬Ã…Â¾Ãƒâ€šÃ‚Â¢ÃƒÆ’Ã†â€™Ãƒâ€ Ã¢â‚¬â„¢ÃƒÆ’Ã¢â‚¬Â ÃƒÂ¢Ã¢â€šÂ¬Ã¢â€žÂ¢ÃƒÆ’Ã†â€™ÃƒÂ¢Ã¢â€šÂ¬Ã…Â¡ÃƒÆ’Ã¢â‚¬Å¡Ãƒâ€šÃ‚Â¢ÃƒÆ’Ã†â€™Ãƒâ€ Ã¢â‚¬â„¢ÃƒÆ’Ã¢â‚¬Å¡Ãƒâ€šÃ‚Â¢ÃƒÆ’Ã†â€™Ãƒâ€šÃ‚Â¢ÃƒÆ’Ã‚Â¢ÃƒÂ¢Ã¢â€šÂ¬Ã…Â¡Ãƒâ€šÃ‚Â¬ÃƒÆ’Ã¢â‚¬Â¦Ãƒâ€šÃ‚Â¡ÃƒÆ’Ã†â€™ÃƒÂ¢Ã¢â€šÂ¬Ã…Â¡ÃƒÆ’Ã¢â‚¬Å¡Ãƒâ€šÃ‚Â¬ÃƒÆ’Ã†â€™Ãƒâ€ Ã¢â‚¬â„¢ÃƒÆ’Ã‚Â¢ÃƒÂ¢Ã¢â‚¬Å¡Ã‚Â¬Ãƒâ€šÃ‚Â¦ÃƒÆ’Ã†â€™ÃƒÂ¢Ã¢â€šÂ¬Ã…Â¡ÃƒÆ’Ã¢â‚¬Å¡Ãƒâ€šÃ‚Â¡ÃƒÆ’Ã†â€™Ãƒâ€ Ã¢â‚¬â„¢ÃƒÆ’Ã¢â‚¬Â ÃƒÂ¢Ã¢â€šÂ¬Ã¢â€žÂ¢ÃƒÆ’Ã†â€™ÃƒÂ¢Ã¢â€šÂ¬Ã‚Â ÃƒÆ’Ã‚Â¢ÃƒÂ¢Ã¢â‚¬Å¡Ã‚Â¬ÃƒÂ¢Ã¢â‚¬Å¾Ã‚Â¢ÃƒÆ’Ã†â€™Ãƒâ€ Ã¢â‚¬â„¢ÃƒÆ’Ã¢â‚¬Å¡Ãƒâ€šÃ‚Â¢ÃƒÆ’Ã†â€™Ãƒâ€šÃ‚Â¢ÃƒÆ’Ã‚Â¢ÃƒÂ¢Ã¢â‚¬Å¡Ã‚Â¬Ãƒâ€¦Ã‚Â¡ÃƒÆ’Ã¢â‚¬Å¡Ãƒâ€šÃ‚Â¬ÃƒÆ’Ã†â€™ÃƒÂ¢Ã¢â€šÂ¬Ã‚Â¦ÃƒÆ’Ã¢â‚¬Å¡Ãƒâ€šÃ‚Â¡ÃƒÆ’Ã†â€™Ãƒâ€ Ã¢â‚¬â„¢ÃƒÆ’Ã¢â‚¬Â ÃƒÂ¢Ã¢â€šÂ¬Ã¢â€žÂ¢ÃƒÆ’Ã†â€™Ãƒâ€šÃ‚Â¢ÃƒÆ’Ã‚Â¢ÃƒÂ¢Ã¢â€šÂ¬Ã…Â¡Ãƒâ€šÃ‚Â¬ÃƒÆ’Ã¢â‚¬Â¦Ãƒâ€šÃ‚Â¡ÃƒÆ’Ã†â€™Ãƒâ€ Ã¢â‚¬â„¢ÃƒÆ’Ã‚Â¢ÃƒÂ¢Ã¢â‚¬Å¡Ã‚Â¬Ãƒâ€¦Ã‚Â¡ÃƒÆ’Ã†â€™ÃƒÂ¢Ã¢â€šÂ¬Ã…Â¡ÃƒÆ’Ã¢â‚¬Å¡Ãƒâ€šÃ‚Â¼g</w:t>
+        <w:t>ÃƒÆ’Ã†â€™Ãƒâ€ Ã¢â‚¬â„¢ÃƒÆ’Ã¢â‚¬Â ÃƒÂ¢Ã¢â€šÂ¬Ã¢â€žÂ¢ÃƒÆ’Ã†â€™ÃƒÂ¢Ã¢â€šÂ¬Ã‚Â ÃƒÆ’Ã‚Â¢ÃƒÂ¢Ã¢â‚¬Å¡Ã‚Â¬ÃƒÂ¢Ã¢â‚¬Å¾Ã‚Â¢ÃƒÆ’Ã†â€™Ãƒâ€ Ã¢â‚¬â„¢ÃƒÆ’Ã‚Â¢ÃƒÂ¢Ã¢â‚¬Å¡Ã‚Â¬Ãƒâ€šÃ‚Â ÃƒÆ’Ã†â€™Ãƒâ€šÃ‚Â¢ÃƒÆ’Ã‚Â¢ÃƒÂ¢Ã¢â€šÂ¬Ã…Â¡Ãƒâ€šÃ‚Â¬ÃƒÆ’Ã‚Â¢ÃƒÂ¢Ã¢â€šÂ¬Ã…Â¾Ãƒâ€šÃ‚Â¢ÃƒÆ’Ã†â€™Ãƒâ€ Ã¢â‚¬â„¢ÃƒÆ’Ã¢â‚¬Â ÃƒÂ¢Ã¢â€šÂ¬Ã¢â€žÂ¢ÃƒÆ’Ã†â€™Ãƒâ€šÃ‚Â¢ÃƒÆ’Ã‚Â¢ÃƒÂ¢Ã¢â€šÂ¬Ã…Â¡Ãƒâ€šÃ‚Â¬ÃƒÆ’Ã¢â‚¬Å¡Ãƒâ€šÃ‚Â ÃƒÆ’Ã†â€™Ãƒâ€ Ã¢â‚¬â„¢ÃƒÆ’Ã¢â‚¬Å¡Ãƒâ€šÃ‚Â¢ÃƒÆ’Ã†â€™Ãƒâ€šÃ‚Â¢ÃƒÆ’Ã‚Â¢ÃƒÂ¢Ã¢â‚¬Å¡Ã‚Â¬Ãƒâ€¦Ã‚Â¡ÃƒÆ’Ã¢â‚¬Å¡Ãƒâ€šÃ‚Â¬ÃƒÆ’Ã†â€™Ãƒâ€šÃ‚Â¢ÃƒÆ’Ã‚Â¢ÃƒÂ¢Ã¢â‚¬Å¡Ã‚Â¬Ãƒâ€¦Ã‚Â¾ÃƒÆ’Ã¢â‚¬Å¡Ãƒâ€šÃ‚Â¢ÃƒÆ’Ã†â€™Ãƒâ€ Ã¢â‚¬â„¢ÃƒÆ’Ã¢â‚¬Â ÃƒÂ¢Ã¢â€šÂ¬Ã¢â€žÂ¢ÃƒÆ’Ã†â€™ÃƒÂ¢Ã¢â€šÂ¬Ã‚Â ÃƒÆ’Ã‚Â¢ÃƒÂ¢Ã¢â‚¬Å¡Ã‚Â¬ÃƒÂ¢Ã¢â‚¬Å¾Ã‚Â¢ÃƒÆ’Ã†â€™Ãƒâ€ Ã¢â‚¬â„¢ÃƒÆ’Ã¢â‚¬Å¡Ãƒâ€šÃ‚Â¢ÃƒÆ’Ã†â€™Ãƒâ€šÃ‚Â¢ÃƒÆ’Ã‚Â¢ÃƒÂ¢Ã¢â‚¬Å¡Ã‚Â¬Ãƒâ€¦Ã‚Â¡ÃƒÆ’Ã¢â‚¬Å¡Ãƒâ€šÃ‚Â¬ÃƒÆ’Ã†â€™ÃƒÂ¢Ã¢â€šÂ¬Ã…Â¡ÃƒÆ’Ã¢â‚¬Å¡Ãƒâ€šÃ‚Â ÃƒÆ’Ã†â€™Ãƒâ€ Ã¢â‚¬â„¢ÃƒÆ’Ã¢â‚¬Â ÃƒÂ¢Ã¢â€šÂ¬Ã¢â€žÂ¢ÃƒÆ’Ã†â€™ÃƒÂ¢Ã¢â€šÂ¬Ã…Â¡ÃƒÆ’Ã¢â‚¬Å¡Ãƒâ€šÃ‚Â¢ÃƒÆ’Ã†â€™Ãƒâ€ Ã¢â‚¬â„¢ÃƒÆ’Ã¢â‚¬Å¡Ãƒâ€šÃ‚Â¢ÃƒÆ’Ã†â€™Ãƒâ€šÃ‚Â¢ÃƒÆ’Ã‚Â¢ÃƒÂ¢Ã¢â€šÂ¬Ã…Â¡Ãƒâ€šÃ‚Â¬ÃƒÆ’Ã¢â‚¬Â¦Ãƒâ€šÃ‚Â¡ÃƒÆ’Ã†â€™ÃƒÂ¢Ã¢â€šÂ¬Ã…Â¡ÃƒÆ’Ã¢â‚¬Å¡Ãƒâ€šÃ‚Â¬ÃƒÆ’Ã†â€™Ãƒâ€ Ã¢â‚¬â„¢ÃƒÆ’Ã¢â‚¬Å¡Ãƒâ€šÃ‚Â¢ÃƒÆ’Ã†â€™Ãƒâ€šÃ‚Â¢ÃƒÆ’Ã‚Â¢ÃƒÂ¢Ã¢â€šÂ¬Ã…Â¡Ãƒâ€šÃ‚Â¬ÃƒÆ’Ã¢â‚¬Â¦Ãƒâ€šÃ‚Â¾ÃƒÆ’Ã†â€™ÃƒÂ¢Ã¢â€šÂ¬Ã…Â¡ÃƒÆ’Ã¢â‚¬Å¡Ãƒâ€šÃ‚Â¢ÃƒÆ’Ã†â€™Ãƒâ€ Ã¢â‚¬â„¢ÃƒÆ’Ã¢â‚¬Â ÃƒÂ¢Ã¢â€šÂ¬Ã¢â€žÂ¢ÃƒÆ’Ã†â€™ÃƒÂ¢Ã¢â€šÂ¬Ã‚Â ÃƒÆ’Ã‚Â¢ÃƒÂ¢Ã¢â‚¬Å¡Ã‚Â¬ÃƒÂ¢Ã¢â‚¬Å¾Ã‚Â¢ÃƒÆ’Ã†â€™Ãƒâ€ Ã¢â‚¬â„¢ÃƒÆ’Ã‚Â¢ÃƒÂ¢Ã¢â‚¬Å¡Ã‚Â¬Ãƒâ€šÃ‚Â ÃƒÆ’Ã†â€™Ãƒâ€šÃ‚Â¢ÃƒÆ’Ã‚Â¢ÃƒÂ¢Ã¢â€šÂ¬Ã…Â¡Ãƒâ€šÃ‚Â¬ÃƒÆ’Ã‚Â¢ÃƒÂ¢Ã¢â€šÂ¬Ã…Â¾Ãƒâ€šÃ‚Â¢ÃƒÆ’Ã†â€™Ãƒâ€ Ã¢â‚¬â„¢ÃƒÆ’Ã¢â‚¬Â ÃƒÂ¢Ã¢â€šÂ¬Ã¢â€žÂ¢ÃƒÆ’Ã†â€™ÃƒÂ¢Ã¢â€šÂ¬Ã…Â¡ÃƒÆ’Ã¢â‚¬Å¡Ãƒâ€šÃ‚Â¢ÃƒÆ’Ã†â€™Ãƒâ€ Ã¢â‚¬â„¢ÃƒÆ’Ã¢â‚¬Å¡Ãƒâ€šÃ‚Â¢ÃƒÆ’Ã†â€™Ãƒâ€šÃ‚Â¢ÃƒÆ’Ã‚Â¢ÃƒÂ¢Ã¢â€šÂ¬Ã…Â¡Ãƒâ€šÃ‚Â¬ÃƒÆ’Ã¢â‚¬Â¦Ãƒâ€šÃ‚Â¡ÃƒÆ’Ã†â€™ÃƒÂ¢Ã¢â€šÂ¬Ã…Â¡ÃƒÆ’Ã¢â‚¬Å¡Ãƒâ€šÃ‚Â¬ÃƒÆ’Ã†â€™Ãƒâ€ Ã¢â‚¬â„¢ÃƒÆ’Ã‚Â¢ÃƒÂ¢Ã¢â‚¬Å¡Ã‚Â¬Ãƒâ€¦Ã‚Â¡ÃƒÆ’Ã†â€™ÃƒÂ¢Ã¢â€šÂ¬Ã…Â¡ÃƒÆ’Ã¢â‚¬Å¡Ãƒâ€šÃ‚Â¦ÃƒÆ’Ã†â€™Ãƒâ€ Ã¢â‚¬â„¢ÃƒÆ’Ã¢â‚¬Â ÃƒÂ¢Ã¢â€šÂ¬Ã¢â€žÂ¢ÃƒÆ’Ã†â€™ÃƒÂ¢Ã¢â€šÂ¬Ã‚Â ÃƒÆ’Ã‚Â¢ÃƒÂ¢Ã¢â‚¬Å¡Ã‚Â¬ÃƒÂ¢Ã¢â‚¬Å¾Ã‚Â¢ÃƒÆ’Ã†â€™Ãƒâ€ Ã¢â‚¬â„¢ÃƒÆ’Ã¢â‚¬Å¡Ãƒâ€šÃ‚Â¢ÃƒÆ’Ã†â€™Ãƒâ€šÃ‚Â¢ÃƒÆ’Ã‚Â¢ÃƒÂ¢Ã¢â‚¬Å¡Ã‚Â¬Ãƒâ€¦Ã‚Â¡ÃƒÆ’Ã¢â‚¬Å¡Ãƒâ€šÃ‚Â¬ÃƒÆ’Ã†â€™ÃƒÂ¢Ã¢â€šÂ¬Ã‚Â¦ÃƒÆ’Ã¢â‚¬Å¡Ãƒâ€šÃ‚Â¡ÃƒÆ’Ã†â€™Ãƒâ€ Ã¢â‚¬â„¢ÃƒÆ’Ã¢â‚¬Â ÃƒÂ¢Ã¢â€šÂ¬Ã¢â€žÂ¢ÃƒÆ’Ã†â€™Ãƒâ€šÃ‚Â¢ÃƒÆ’Ã‚Â¢ÃƒÂ¢Ã¢â€šÂ¬Ã…Â¡Ãƒâ€šÃ‚Â¬ÃƒÆ’Ã¢â‚¬Â¦Ãƒâ€šÃ‚Â¡ÃƒÆ’Ã†â€™Ãƒâ€ Ã¢â‚¬â„¢ÃƒÆ’Ã‚Â¢ÃƒÂ¢Ã¢â‚¬Å¡Ã‚Â¬Ãƒâ€¦Ã‚Â¡ÃƒÆ’Ã†â€™ÃƒÂ¢Ã¢â€šÂ¬Ã…Â¡ÃƒÆ’Ã¢â‚¬Å¡Ãƒâ€šÃ‚Â½ÃƒÆ’Ã†â€™Ãƒâ€ Ã¢â‚¬â„¢ÃƒÆ’Ã¢â‚¬Â ÃƒÂ¢Ã¢â€šÂ¬Ã¢â€žÂ¢ÃƒÆ’Ã†â€™ÃƒÂ¢Ã¢â€šÂ¬Ã‚Â ÃƒÆ’Ã‚Â¢ÃƒÂ¢Ã¢â‚¬Å¡Ã‚Â¬ÃƒÂ¢Ã¢â‚¬Å¾Ã‚Â¢ÃƒÆ’Ã†â€™Ãƒâ€ Ã¢â‚¬â„¢ÃƒÆ’Ã‚Â¢ÃƒÂ¢Ã¢â‚¬Å¡Ã‚Â¬Ãƒâ€šÃ‚Â ÃƒÆ’Ã†â€™Ãƒâ€šÃ‚Â¢ÃƒÆ’Ã‚Â¢ÃƒÂ¢Ã¢â€šÂ¬Ã…Â¡Ãƒâ€šÃ‚Â¬ÃƒÆ’Ã‚Â¢ÃƒÂ¢Ã¢â€šÂ¬Ã…Â¾Ãƒâ€šÃ‚Â¢ÃƒÆ’Ã†â€™Ãƒâ€ Ã¢â‚¬â„¢ÃƒÆ’Ã¢â‚¬Â ÃƒÂ¢Ã¢â€šÂ¬Ã¢â€žÂ¢ÃƒÆ’Ã†â€™Ãƒâ€šÃ‚Â¢ÃƒÆ’Ã‚Â¢ÃƒÂ¢Ã¢â€šÂ¬Ã…Â¡Ãƒâ€šÃ‚Â¬ÃƒÆ’Ã¢â‚¬Å¡Ãƒâ€šÃ‚Â ÃƒÆ’Ã†â€™Ãƒâ€ Ã¢â‚¬â„¢ÃƒÆ’Ã¢â‚¬Å¡Ãƒâ€šÃ‚Â¢ÃƒÆ’Ã†â€™Ãƒâ€šÃ‚Â¢ÃƒÆ’Ã‚Â¢ÃƒÂ¢Ã¢â‚¬Å¡Ã‚Â¬Ãƒâ€¦Ã‚Â¡ÃƒÆ’Ã¢â‚¬Å¡Ãƒâ€šÃ‚Â¬ÃƒÆ’Ã†â€™Ãƒâ€šÃ‚Â¢ÃƒÆ’Ã‚Â¢ÃƒÂ¢Ã¢â‚¬Å¡Ã‚Â¬Ãƒâ€¦Ã‚Â¾ÃƒÆ’Ã¢â‚¬Å¡Ãƒâ€šÃ‚Â¢ÃƒÆ’Ã†â€™Ãƒâ€ Ã¢â‚¬â„¢ÃƒÆ’Ã¢â‚¬Â ÃƒÂ¢Ã¢â€šÂ¬Ã¢â€žÂ¢ÃƒÆ’Ã†â€™ÃƒÂ¢Ã¢â€šÂ¬Ã‚Â ÃƒÆ’Ã‚Â¢ÃƒÂ¢Ã¢â‚¬Å¡Ã‚Â¬ÃƒÂ¢Ã¢â‚¬Å¾Ã‚Â¢ÃƒÆ’Ã†â€™Ãƒâ€ Ã¢â‚¬â„¢ÃƒÆ’Ã‚Â¢ÃƒÂ¢Ã¢â‚¬Å¡Ã‚Â¬Ãƒâ€¦Ã‚Â¡ÃƒÆ’Ã†â€™ÃƒÂ¢Ã¢â€šÂ¬Ã…Â¡ÃƒÆ’Ã¢â‚¬Å¡Ãƒâ€šÃ‚Â¢ÃƒÆ’Ã†â€™Ãƒâ€ Ã¢â‚¬â„¢ÃƒÆ’Ã¢â‚¬Â ÃƒÂ¢Ã¢â€šÂ¬Ã¢â€žÂ¢ÃƒÆ’Ã†â€™ÃƒÂ¢Ã¢â€šÂ¬Ã…Â¡ÃƒÆ’Ã¢â‚¬Å¡Ãƒâ€šÃ‚Â¢ÃƒÆ’Ã†â€™Ãƒâ€ Ã¢â‚¬â„¢ÃƒÆ’Ã¢â‚¬Å¡Ãƒâ€šÃ‚Â¢ÃƒÆ’Ã†â€™Ãƒâ€šÃ‚Â¢ÃƒÆ’Ã‚Â¢ÃƒÂ¢Ã¢â‚¬Å¡Ã‚Â¬Ãƒâ€¦Ã‚Â¡ÃƒÆ’Ã¢â‚¬Å¡Ãƒâ€šÃ‚Â¬ÃƒÆ’Ã†â€™ÃƒÂ¢Ã¢â€šÂ¬Ã‚Â¦ÃƒÆ’Ã¢â‚¬Å¡Ãƒâ€šÃ‚Â¡ÃƒÆ’Ã†â€™Ãƒâ€ Ã¢â‚¬â„¢ÃƒÆ’Ã‚Â¢ÃƒÂ¢Ã¢â‚¬Å¡Ã‚Â¬Ãƒâ€¦Ã‚Â¡ÃƒÆ’Ã†â€™ÃƒÂ¢Ã¢â€šÂ¬Ã…Â¡ÃƒÆ’Ã¢â‚¬Å¡Ãƒâ€šÃ‚Â¬ÃƒÆ’Ã†â€™Ãƒâ€ Ã¢â‚¬â„¢ÃƒÆ’Ã¢â‚¬Â ÃƒÂ¢Ã¢â€šÂ¬Ã¢â€žÂ¢ÃƒÆ’Ã†â€™Ãƒâ€šÃ‚Â¢ÃƒÆ’Ã‚Â¢ÃƒÂ¢Ã¢â€šÂ¬Ã…Â¡Ãƒâ€šÃ‚Â¬ÃƒÆ’Ã¢â‚¬Å¡Ãƒâ€šÃ‚Â¦ÃƒÆ’Ã†â€™Ãƒâ€ Ã¢â‚¬â„¢ÃƒÆ’Ã‚Â¢ÃƒÂ¢Ã¢â‚¬Å¡Ã‚Â¬Ãƒâ€¦Ã‚Â¡ÃƒÆ’Ã†â€™ÃƒÂ¢Ã¢â€šÂ¬Ã…Â¡ÃƒÆ’Ã¢â‚¬Å¡Ãƒâ€šÃ‚Â¡ÃƒÆ’Ã†â€™Ãƒâ€ Ã¢â‚¬â„¢ÃƒÆ’Ã¢â‚¬Â ÃƒÂ¢Ã¢â€šÂ¬Ã¢â€žÂ¢ÃƒÆ’Ã†â€™ÃƒÂ¢Ã¢â€šÂ¬Ã‚Â ÃƒÆ’Ã‚Â¢ÃƒÂ¢Ã¢â‚¬Å¡Ã‚Â¬ÃƒÂ¢Ã¢â‚¬Å¾Ã‚Â¢ÃƒÆ’Ã†â€™Ãƒâ€ Ã¢â‚¬â„¢ÃƒÆ’Ã‚Â¢ÃƒÂ¢Ã¢â‚¬Å¡Ã‚Â¬Ãƒâ€šÃ‚Â ÃƒÆ’Ã†â€™Ãƒâ€šÃ‚Â¢ÃƒÆ’Ã‚Â¢ÃƒÂ¢Ã¢â€šÂ¬Ã…Â¡Ãƒâ€šÃ‚Â¬ÃƒÆ’Ã‚Â¢ÃƒÂ¢Ã¢â€šÂ¬Ã…Â¾Ãƒâ€šÃ‚Â¢ÃƒÆ’Ã†â€™Ãƒâ€ Ã¢â‚¬â„¢ÃƒÆ’Ã¢â‚¬Â ÃƒÂ¢Ã¢â€šÂ¬Ã¢â€žÂ¢ÃƒÆ’Ã†â€™ÃƒÂ¢Ã¢â€šÂ¬Ã…Â¡ÃƒÆ’Ã¢â‚¬Å¡Ãƒâ€šÃ‚Â¢ÃƒÆ’Ã†â€™Ãƒâ€ Ã¢â‚¬â„¢ÃƒÆ’Ã¢â‚¬Å¡Ãƒâ€šÃ‚Â¢ÃƒÆ’Ã†â€™Ãƒâ€šÃ‚Â¢ÃƒÆ’Ã‚Â¢ÃƒÂ¢Ã¢â€šÂ¬Ã…Â¡Ãƒâ€šÃ‚Â¬ÃƒÆ’Ã¢â‚¬Â¦Ãƒâ€šÃ‚Â¡ÃƒÆ’Ã†â€™ÃƒÂ¢Ã¢â€šÂ¬Ã…Â¡ÃƒÆ’Ã¢â‚¬Å¡Ãƒâ€šÃ‚Â¬ÃƒÆ’Ã†â€™Ãƒâ€ Ã¢â‚¬â„¢ÃƒÆ’Ã‚Â¢ÃƒÂ¢Ã¢â‚¬Å¡Ã‚Â¬Ãƒâ€šÃ‚Â¦ÃƒÆ’Ã†â€™ÃƒÂ¢Ã¢â€šÂ¬Ã…Â¡ÃƒÆ’Ã¢â‚¬Å¡Ãƒâ€šÃ‚Â¡ÃƒÆ’Ã†â€™Ãƒâ€ Ã¢â‚¬â„¢ÃƒÆ’Ã¢â‚¬Â ÃƒÂ¢Ã¢â€šÂ¬Ã¢â€žÂ¢ÃƒÆ’Ã†â€™ÃƒÂ¢Ã¢â€šÂ¬Ã‚Â ÃƒÆ’Ã‚Â¢ÃƒÂ¢Ã¢â‚¬Å¡Ã‚Â¬ÃƒÂ¢Ã¢â‚¬Å¾Ã‚Â¢ÃƒÆ’Ã†â€™Ãƒâ€ Ã¢â‚¬â„¢ÃƒÆ’Ã¢â‚¬Å¡Ãƒâ€šÃ‚Â¢ÃƒÆ’Ã†â€™Ãƒâ€šÃ‚Â¢ÃƒÆ’Ã‚Â¢ÃƒÂ¢Ã¢â‚¬Å¡Ã‚Â¬Ãƒâ€¦Ã‚Â¡ÃƒÆ’Ã¢â‚¬Å¡Ãƒâ€šÃ‚Â¬ÃƒÆ’Ã†â€™ÃƒÂ¢Ã¢â€šÂ¬Ã‚Â¦ÃƒÆ’Ã¢â‚¬Å¡Ãƒâ€šÃ‚Â¡ÃƒÆ’Ã†â€™Ãƒâ€ Ã¢â‚¬â„¢ÃƒÆ’Ã¢â‚¬Â ÃƒÂ¢Ã¢â€šÂ¬Ã¢â€žÂ¢ÃƒÆ’Ã†â€™Ãƒâ€šÃ‚Â¢ÃƒÆ’Ã‚Â¢ÃƒÂ¢Ã¢â€šÂ¬Ã…Â¡Ãƒâ€šÃ‚Â¬ÃƒÆ’Ã¢â‚¬Â¦Ãƒâ€šÃ‚Â¡ÃƒÆ’Ã†â€™Ãƒâ€ Ã¢â‚¬â„¢ÃƒÆ’Ã‚Â¢ÃƒÂ¢Ã¢â‚¬Å¡Ã‚Â¬Ãƒâ€¦Ã‚Â¡ÃƒÆ’Ã†â€™ÃƒÂ¢Ã¢â€šÂ¬Ã…Â¡ÃƒÆ’Ã¢â‚¬Å¡Ãƒâ€šÃ‚Â¼g</w:t>
       </w:r>
       <w:proofErr w:type="spellEnd"/>
       <w:r>
@@ -9152,7 +9152,7 @@
           <w:sz w:val="28"/>
           <w:szCs w:val="28"/>
         </w:rPr>
-        <w:t>ÃƒÆ’Ã†â€™Ãƒâ€ Ã¢â‚¬â„¢ÃƒÆ’Ã¢â‚¬Â ÃƒÂ¢Ã¢â€šÂ¬Ã¢â€žÂ¢ÃƒÆ’Ã†â€™ÃƒÂ¢Ã¢â€šÂ¬Ã‚Â ÃƒÆ’Ã‚Â¢ÃƒÂ¢Ã¢â‚¬Å¡Ã‚Â¬ÃƒÂ¢Ã¢â‚¬Å¾Ã‚Â¢ÃƒÆ’Ã†â€™Ãƒâ€ Ã¢â‚¬â„¢ÃƒÆ’Ã‚Â¢ÃƒÂ¢Ã¢â‚¬Å¡Ã‚Â¬Ãƒâ€šÃ‚Â ÃƒÆ’Ã†â€™Ãƒâ€šÃ‚Â¢ÃƒÆ’Ã‚Â¢ÃƒÂ¢Ã¢â€šÂ¬Ã…Â¡Ãƒâ€šÃ‚Â¬ÃƒÆ’Ã‚Â¢ÃƒÂ¢Ã¢â€šÂ¬Ã…Â¾Ãƒâ€šÃ‚Â¢ÃƒÆ’Ã†â€™Ãƒâ€ Ã¢â‚¬â„¢ÃƒÆ’Ã¢â‚¬Â ÃƒÂ¢Ã¢â€šÂ¬Ã¢â€žÂ¢ÃƒÆ’Ã†â€™Ãƒâ€šÃ‚Â¢ÃƒÆ’Ã‚Â¢ÃƒÂ¢Ã¢â€šÂ¬Ã…Â¡Ãƒâ€šÃ‚Â¬ÃƒÆ’Ã¢â‚¬Å¡Ãƒâ€šÃ‚Â ÃƒÆ’Ã†â€™Ãƒâ€ Ã¢â‚¬â„¢ÃƒÆ’Ã¢â‚¬Å¡Ãƒâ€šÃ‚Â¢ÃƒÆ’Ã†â€™Ãƒâ€šÃ‚Â¢ÃƒÆ’Ã‚Â¢ÃƒÂ¢Ã¢â‚¬Å¡Ã‚Â¬Ãƒâ€¦Ã‚Â¡ÃƒÆ’Ã¢â‚¬Å¡Ãƒâ€šÃ‚Â¬ÃƒÆ’Ã†â€™Ãƒâ€šÃ‚Â¢ÃƒÆ’Ã‚Â¢ÃƒÂ¢Ã¢â‚¬Å¡Ã‚Â¬Ãƒâ€¦Ã‚Â¾ÃƒÆ’Ã¢â‚¬Å¡Ãƒâ€šÃ‚Â¢ÃƒÆ’Ã†â€™Ãƒâ€ Ã¢â‚¬â„¢ÃƒÆ’Ã¢â‚¬Â ÃƒÂ¢Ã¢â€šÂ¬Ã¢â€žÂ¢ÃƒÆ’Ã†â€™ÃƒÂ¢Ã¢â€šÂ¬Ã‚Â ÃƒÆ’Ã‚Â¢ÃƒÂ¢Ã¢â‚¬Å¡Ã‚Â¬ÃƒÂ¢Ã¢â‚¬Å¾Ã‚Â¢ÃƒÆ’Ã†â€™Ãƒâ€ Ã¢â‚¬â„¢ÃƒÆ’Ã¢â‚¬Å¡Ãƒâ€šÃ‚Â¢ÃƒÆ’Ã†â€™Ãƒâ€šÃ‚Â¢ÃƒÆ’Ã‚Â¢ÃƒÂ¢Ã¢â‚¬Å¡Ã‚Â¬Ãƒâ€¦Ã‚Â¡ÃƒÆ’Ã¢â‚¬Å¡Ãƒâ€šÃ‚Â¬ÃƒÆ’Ã†â€™ÃƒÂ¢Ã¢â€šÂ¬Ã…Â¡ÃƒÆ’Ã¢â‚¬Å¡Ãƒâ€šÃ‚Â¦ÃƒÆ’Ã†â€™Ãƒâ€ Ã¢â‚¬â„¢ÃƒÆ’Ã¢â‚¬Â ÃƒÂ¢Ã¢â€šÂ¬Ã¢â€žÂ¢ÃƒÆ’Ã†â€™Ãƒâ€šÃ‚Â¢ÃƒÆ’Ã‚Â¢ÃƒÂ¢Ã¢â€šÂ¬Ã…Â¡Ãƒâ€šÃ‚Â¬ÃƒÆ’Ã¢â‚¬Â¦Ãƒâ€šÃ‚Â¡ÃƒÆ’Ã†â€™Ãƒâ€ Ã¢â‚¬â„¢ÃƒÆ’Ã‚Â¢ÃƒÂ¢Ã¢â‚¬Å¡Ã‚Â¬Ãƒâ€¦Ã‚Â¡ÃƒÆ’Ã†â€™ÃƒÂ¢Ã¢â€šÂ¬Ã…Â¡ÃƒÆ’Ã¢â‚¬Å¡Ãƒâ€šÃ‚Â½ÃƒÆ’Ã†â€™Ãƒâ€ Ã¢â‚¬â„¢ÃƒÆ’Ã¢â‚¬Â ÃƒÂ¢Ã¢â€šÂ¬Ã¢â€žÂ¢ÃƒÆ’Ã†â€™ÃƒÂ¢Ã¢â€šÂ¬Ã‚Â ÃƒÆ’Ã‚Â¢ÃƒÂ¢Ã¢â‚¬Å¡Ã‚Â¬ÃƒÂ¢Ã¢â‚¬Å¾Ã‚Â¢ÃƒÆ’Ã†â€™Ãƒâ€ Ã¢â‚¬â„¢ÃƒÆ’Ã‚Â¢ÃƒÂ¢Ã¢â‚¬Å¡Ã‚Â¬Ãƒâ€šÃ‚Â ÃƒÆ’Ã†â€™Ãƒâ€šÃ‚Â¢ÃƒÆ’Ã‚Â¢ÃƒÂ¢Ã¢â€šÂ¬Ã…Â¡Ãƒâ€šÃ‚Â¬ÃƒÆ’Ã‚Â¢ÃƒÂ¢Ã¢â€šÂ¬Ã…Â¾Ãƒâ€šÃ‚Â¢ÃƒÆ’Ã†â€™Ãƒâ€ Ã¢â‚¬â„¢ÃƒÆ’Ã¢â‚¬Â ÃƒÂ¢Ã¢â€šÂ¬Ã¢â€žÂ¢ÃƒÆ’Ã†â€™ÃƒÂ¢Ã¢â€šÂ¬Ã…Â¡ÃƒÆ’Ã¢â‚¬Å¡Ãƒâ€šÃ‚Â¢ÃƒÆ’Ã†â€™Ãƒâ€ Ã¢â‚¬â„¢ÃƒÆ’Ã¢â‚¬Å¡Ãƒâ€šÃ‚Â¢ÃƒÆ’Ã†â€™Ãƒâ€šÃ‚Â¢ÃƒÆ’Ã‚Â¢ÃƒÂ¢Ã¢â€šÂ¬Ã…Â¡Ãƒâ€šÃ‚Â¬ÃƒÆ’Ã¢â‚¬Â¦Ãƒâ€šÃ‚Â¡ÃƒÆ’Ã†â€™ÃƒÂ¢Ã¢â€šÂ¬Ã…Â¡ÃƒÆ’Ã¢â‚¬Å¡Ãƒâ€šÃ‚Â¬ÃƒÆ’Ã†â€™Ãƒâ€ Ã¢â‚¬â„¢ÃƒÆ’Ã‚Â¢ÃƒÂ¢Ã¢â‚¬Å¡Ã‚Â¬Ãƒâ€šÃ‚Â¦ÃƒÆ’Ã†â€™ÃƒÂ¢Ã¢â€šÂ¬Ã…Â¡ÃƒÆ’Ã¢â‚¬Å¡Ãƒâ€šÃ‚Â¡ÃƒÆ’Ã†â€™Ãƒâ€ Ã¢â‚¬â„¢ÃƒÆ’Ã¢â‚¬Â ÃƒÂ¢Ã¢â€šÂ¬Ã¢â€žÂ¢ÃƒÆ’Ã†â€™ÃƒÂ¢Ã¢â€šÂ¬Ã‚Â ÃƒÆ’Ã‚Â¢ÃƒÂ¢Ã¢â‚¬Å¡Ã‚Â¬ÃƒÂ¢Ã¢â‚¬Å¾Ã‚Â¢ÃƒÆ’Ã†â€™Ãƒâ€ Ã¢â‚¬â„¢ÃƒÆ’Ã¢â‚¬Å¡Ãƒâ€šÃ‚Â¢ÃƒÆ’Ã†â€™Ãƒâ€šÃ‚Â¢ÃƒÆ’Ã‚Â¢ÃƒÂ¢Ã¢â‚¬Å¡Ã‚Â¬Ãƒâ€¦Ã‚Â¡ÃƒÆ’Ã¢â‚¬Å¡Ãƒâ€šÃ‚Â¬ÃƒÆ’Ã†â€™ÃƒÂ¢Ã¢â€šÂ¬Ã‚Â¦ÃƒÆ’Ã¢â‚¬Å¡Ãƒâ€šÃ‚Â¡ÃƒÆ’Ã†â€™Ãƒâ€ Ã¢â‚¬â„¢ÃƒÆ’Ã¢â‚¬Â ÃƒÂ¢Ã¢â€šÂ¬Ã¢â€žÂ¢ÃƒÆ’Ã†â€™Ãƒâ€šÃ‚Â¢ÃƒÆ’Ã‚Â¢ÃƒÂ¢Ã¢â€šÂ¬Ã…Â¡Ãƒâ€šÃ‚Â¬ÃƒÆ’Ã¢â‚¬Â¦Ãƒâ€šÃ‚Â¡ÃƒÆ’Ã†â€™Ãƒâ€ Ã¢â‚¬â„¢ÃƒÆ’Ã‚Â¢ÃƒÂ¢Ã¢â‚¬Å¡Ã‚Â¬Ãƒâ€¦Ã‚Â¡ÃƒÆ’Ã†â€™ÃƒÂ¢Ã¢â€šÂ¬Ã…Â¡ÃƒÆ’Ã¢â‚¬Å¡Ãƒâ€šÃ‚Â¼g</w:t>
+        <w:t>ÃƒÆ’Ã†â€™Ãƒâ€ Ã¢â‚¬â„¢ÃƒÆ’Ã¢â‚¬Â ÃƒÂ¢Ã¢â€šÂ¬Ã¢â€žÂ¢ÃƒÆ’Ã†â€™ÃƒÂ¢Ã¢â€šÂ¬Ã‚Â ÃƒÆ’Ã‚Â¢ÃƒÂ¢Ã¢â‚¬Å¡Ã‚Â¬ÃƒÂ¢Ã¢â‚¬Å¾Ã‚Â¢ÃƒÆ’Ã†â€™Ãƒâ€ Ã¢â‚¬â„¢ÃƒÆ’Ã‚Â¢ÃƒÂ¢Ã¢â‚¬Å¡Ã‚Â¬Ãƒâ€šÃ‚Â ÃƒÆ’Ã†â€™Ãƒâ€šÃ‚Â¢ÃƒÆ’Ã‚Â¢ÃƒÂ¢Ã¢â€šÂ¬Ã…Â¡Ãƒâ€šÃ‚Â¬ÃƒÆ’Ã‚Â¢ÃƒÂ¢Ã¢â€šÂ¬Ã…Â¾Ãƒâ€šÃ‚Â¢ÃƒÆ’Ã†â€™Ãƒâ€ Ã¢â‚¬â„¢ÃƒÆ’Ã¢â‚¬Â ÃƒÂ¢Ã¢â€šÂ¬Ã¢â€žÂ¢ÃƒÆ’Ã†â€™Ãƒâ€šÃ‚Â¢ÃƒÆ’Ã‚Â¢ÃƒÂ¢Ã¢â€šÂ¬Ã…Â¡Ãƒâ€šÃ‚Â¬ÃƒÆ’Ã¢â‚¬Å¡Ãƒâ€šÃ‚Â ÃƒÆ’Ã†â€™Ãƒâ€ Ã¢â‚¬â„¢ÃƒÆ’Ã¢â‚¬Å¡Ãƒâ€šÃ‚Â¢ÃƒÆ’Ã†â€™Ãƒâ€šÃ‚Â¢ÃƒÆ’Ã‚Â¢ÃƒÂ¢Ã¢â‚¬Å¡Ã‚Â¬Ãƒâ€¦Ã‚Â¡ÃƒÆ’Ã¢â‚¬Å¡Ãƒâ€šÃ‚Â¬ÃƒÆ’Ã†â€™Ãƒâ€šÃ‚Â¢ÃƒÆ’Ã‚Â¢ÃƒÂ¢Ã¢â‚¬Å¡Ã‚Â¬Ãƒâ€¦Ã‚Â¾ÃƒÆ’Ã¢â‚¬Å¡Ãƒâ€šÃ‚Â¢ÃƒÆ’Ã†â€™Ãƒâ€ Ã¢â‚¬â„¢ÃƒÆ’Ã¢â‚¬Â ÃƒÂ¢Ã¢â€šÂ¬Ã¢â€žÂ¢ÃƒÆ’Ã†â€™ÃƒÂ¢Ã¢â€šÂ¬Ã‚Â ÃƒÆ’Ã‚Â¢ÃƒÂ¢Ã¢â‚¬Å¡Ã‚Â¬ÃƒÂ¢Ã¢â‚¬Å¾Ã‚Â¢ÃƒÆ’Ã†â€™Ãƒâ€ Ã¢â‚¬â„¢ÃƒÆ’Ã¢â‚¬Å¡Ãƒâ€šÃ‚Â¢ÃƒÆ’Ã†â€™Ãƒâ€šÃ‚Â¢ÃƒÆ’Ã‚Â¢ÃƒÂ¢Ã¢â‚¬Å¡Ã‚Â¬Ãƒâ€¦Ã‚Â¡ÃƒÆ’Ã¢â‚¬Å¡Ãƒâ€šÃ‚Â¬ÃƒÆ’Ã†â€™ÃƒÂ¢Ã¢â€šÂ¬Ã…Â¡ÃƒÆ’Ã¢â‚¬Å¡Ãƒâ€šÃ‚Â ÃƒÆ’Ã†â€™Ãƒâ€ Ã¢â‚¬â„¢ÃƒÆ’Ã¢â‚¬Â ÃƒÂ¢Ã¢â€šÂ¬Ã¢â€žÂ¢ÃƒÆ’Ã†â€™ÃƒÂ¢Ã¢â€šÂ¬Ã…Â¡ÃƒÆ’Ã¢â‚¬Å¡Ãƒâ€šÃ‚Â¢ÃƒÆ’Ã†â€™Ãƒâ€ Ã¢â‚¬â„¢ÃƒÆ’Ã¢â‚¬Å¡Ãƒâ€šÃ‚Â¢ÃƒÆ’Ã†â€™Ãƒâ€šÃ‚Â¢ÃƒÆ’Ã‚Â¢ÃƒÂ¢Ã¢â€šÂ¬Ã…Â¡Ãƒâ€šÃ‚Â¬ÃƒÆ’Ã¢â‚¬Â¦Ãƒâ€šÃ‚Â¡ÃƒÆ’Ã†â€™ÃƒÂ¢Ã¢â€šÂ¬Ã…Â¡ÃƒÆ’Ã¢â‚¬Å¡Ãƒâ€šÃ‚Â¬ÃƒÆ’Ã†â€™Ãƒâ€ Ã¢â‚¬â„¢ÃƒÆ’Ã¢â‚¬Å¡Ãƒâ€šÃ‚Â¢ÃƒÆ’Ã†â€™Ãƒâ€šÃ‚Â¢ÃƒÆ’Ã‚Â¢ÃƒÂ¢Ã¢â€šÂ¬Ã…Â¡Ãƒâ€šÃ‚Â¬ÃƒÆ’Ã¢â‚¬Â¦Ãƒâ€šÃ‚Â¾ÃƒÆ’Ã†â€™ÃƒÂ¢Ã¢â€šÂ¬Ã…Â¡ÃƒÆ’Ã¢â‚¬Å¡Ãƒâ€šÃ‚Â¢ÃƒÆ’Ã†â€™Ãƒâ€ Ã¢â‚¬â„¢ÃƒÆ’Ã¢â‚¬Â ÃƒÂ¢Ã¢â€šÂ¬Ã¢â€žÂ¢ÃƒÆ’Ã†â€™ÃƒÂ¢Ã¢â€šÂ¬Ã‚Â ÃƒÆ’Ã‚Â¢ÃƒÂ¢Ã¢â‚¬Å¡Ã‚Â¬ÃƒÂ¢Ã¢â‚¬Å¾Ã‚Â¢ÃƒÆ’Ã†â€™Ãƒâ€ Ã¢â‚¬â„¢ÃƒÆ’Ã‚Â¢ÃƒÂ¢Ã¢â‚¬Å¡Ã‚Â¬Ãƒâ€šÃ‚Â ÃƒÆ’Ã†â€™Ãƒâ€šÃ‚Â¢ÃƒÆ’Ã‚Â¢ÃƒÂ¢Ã¢â€šÂ¬Ã…Â¡Ãƒâ€šÃ‚Â¬ÃƒÆ’Ã‚Â¢ÃƒÂ¢Ã¢â€šÂ¬Ã…Â¾Ãƒâ€šÃ‚Â¢ÃƒÆ’Ã†â€™Ãƒâ€ Ã¢â‚¬â„¢ÃƒÆ’Ã¢â‚¬Â ÃƒÂ¢Ã¢â€šÂ¬Ã¢â€žÂ¢ÃƒÆ’Ã†â€™ÃƒÂ¢Ã¢â€šÂ¬Ã…Â¡ÃƒÆ’Ã¢â‚¬Å¡Ãƒâ€šÃ‚Â¢ÃƒÆ’Ã†â€™Ãƒâ€ Ã¢â‚¬â„¢ÃƒÆ’Ã¢â‚¬Å¡Ãƒâ€šÃ‚Â¢ÃƒÆ’Ã†â€™Ãƒâ€šÃ‚Â¢ÃƒÆ’Ã‚Â¢ÃƒÂ¢Ã¢â€šÂ¬Ã…Â¡Ãƒâ€šÃ‚Â¬ÃƒÆ’Ã¢â‚¬Â¦Ãƒâ€šÃ‚Â¡ÃƒÆ’Ã†â€™ÃƒÂ¢Ã¢â€šÂ¬Ã…Â¡ÃƒÆ’Ã¢â‚¬Å¡Ãƒâ€šÃ‚Â¬ÃƒÆ’Ã†â€™Ãƒâ€ Ã¢â‚¬â„¢ÃƒÆ’Ã‚Â¢ÃƒÂ¢Ã¢â‚¬Å¡Ã‚Â¬Ãƒâ€¦Ã‚Â¡ÃƒÆ’Ã†â€™ÃƒÂ¢Ã¢â€šÂ¬Ã…Â¡ÃƒÆ’Ã¢â‚¬Å¡Ãƒâ€šÃ‚Â¦ÃƒÆ’Ã†â€™Ãƒâ€ Ã¢â‚¬â„¢ÃƒÆ’Ã¢â‚¬Â ÃƒÂ¢Ã¢â€šÂ¬Ã¢â€žÂ¢ÃƒÆ’Ã†â€™ÃƒÂ¢Ã¢â€šÂ¬Ã‚Â ÃƒÆ’Ã‚Â¢ÃƒÂ¢Ã¢â‚¬Å¡Ã‚Â¬ÃƒÂ¢Ã¢â‚¬Å¾Ã‚Â¢ÃƒÆ’Ã†â€™Ãƒâ€ Ã¢â‚¬â„¢ÃƒÆ’Ã¢â‚¬Å¡Ãƒâ€šÃ‚Â¢ÃƒÆ’Ã†â€™Ãƒâ€šÃ‚Â¢ÃƒÆ’Ã‚Â¢ÃƒÂ¢Ã¢â‚¬Å¡Ã‚Â¬Ãƒâ€¦Ã‚Â¡ÃƒÆ’Ã¢â‚¬Å¡Ãƒâ€šÃ‚Â¬ÃƒÆ’Ã†â€™ÃƒÂ¢Ã¢â€šÂ¬Ã‚Â¦ÃƒÆ’Ã¢â‚¬Å¡Ãƒâ€šÃ‚Â¡ÃƒÆ’Ã†â€™Ãƒâ€ Ã¢â‚¬â„¢ÃƒÆ’Ã¢â‚¬Â ÃƒÂ¢Ã¢â€šÂ¬Ã¢â€žÂ¢ÃƒÆ’Ã†â€™Ãƒâ€šÃ‚Â¢ÃƒÆ’Ã‚Â¢ÃƒÂ¢Ã¢â€šÂ¬Ã…Â¡Ãƒâ€šÃ‚Â¬ÃƒÆ’Ã¢â‚¬Â¦Ãƒâ€šÃ‚Â¡ÃƒÆ’Ã†â€™Ãƒâ€ Ã¢â‚¬â„¢ÃƒÆ’Ã‚Â¢ÃƒÂ¢Ã¢â‚¬Å¡Ã‚Â¬Ãƒâ€¦Ã‚Â¡ÃƒÆ’Ã†â€™ÃƒÂ¢Ã¢â€šÂ¬Ã…Â¡ÃƒÆ’Ã¢â‚¬Å¡Ãƒâ€šÃ‚Â½ÃƒÆ’Ã†â€™Ãƒâ€ Ã¢â‚¬â„¢ÃƒÆ’Ã¢â‚¬Â ÃƒÂ¢Ã¢â€šÂ¬Ã¢â€žÂ¢ÃƒÆ’Ã†â€™ÃƒÂ¢Ã¢â€šÂ¬Ã‚Â ÃƒÆ’Ã‚Â¢ÃƒÂ¢Ã¢â‚¬Å¡Ã‚Â¬ÃƒÂ¢Ã¢â‚¬Å¾Ã‚Â¢ÃƒÆ’Ã†â€™Ãƒâ€ Ã¢â‚¬â„¢ÃƒÆ’Ã‚Â¢ÃƒÂ¢Ã¢â‚¬Å¡Ã‚Â¬Ãƒâ€šÃ‚Â ÃƒÆ’Ã†â€™Ãƒâ€šÃ‚Â¢ÃƒÆ’Ã‚Â¢ÃƒÂ¢Ã¢â€šÂ¬Ã…Â¡Ãƒâ€šÃ‚Â¬ÃƒÆ’Ã‚Â¢ÃƒÂ¢Ã¢â€šÂ¬Ã…Â¾Ãƒâ€šÃ‚Â¢ÃƒÆ’Ã†â€™Ãƒâ€ Ã¢â‚¬â„¢ÃƒÆ’Ã¢â‚¬Â ÃƒÂ¢Ã¢â€šÂ¬Ã¢â€žÂ¢ÃƒÆ’Ã†â€™Ãƒâ€šÃ‚Â¢ÃƒÆ’Ã‚Â¢ÃƒÂ¢Ã¢â€šÂ¬Ã…Â¡Ãƒâ€šÃ‚Â¬ÃƒÆ’Ã¢â‚¬Å¡Ãƒâ€šÃ‚Â ÃƒÆ’Ã†â€™Ãƒâ€ Ã¢â‚¬â„¢ÃƒÆ’Ã¢â‚¬Å¡Ãƒâ€šÃ‚Â¢ÃƒÆ’Ã†â€™Ãƒâ€šÃ‚Â¢ÃƒÆ’Ã‚Â¢ÃƒÂ¢Ã¢â‚¬Å¡Ã‚Â¬Ãƒâ€¦Ã‚Â¡ÃƒÆ’Ã¢â‚¬Å¡Ãƒâ€šÃ‚Â¬ÃƒÆ’Ã†â€™Ãƒâ€šÃ‚Â¢ÃƒÆ’Ã‚Â¢ÃƒÂ¢Ã¢â‚¬Å¡Ã‚Â¬Ãƒâ€¦Ã‚Â¾ÃƒÆ’Ã¢â‚¬Å¡Ãƒâ€šÃ‚Â¢ÃƒÆ’Ã†â€™Ãƒâ€ Ã¢â‚¬â„¢ÃƒÆ’Ã¢â‚¬Â ÃƒÂ¢Ã¢â€šÂ¬Ã¢â€žÂ¢ÃƒÆ’Ã†â€™ÃƒÂ¢Ã¢â€šÂ¬Ã‚Â ÃƒÆ’Ã‚Â¢ÃƒÂ¢Ã¢â‚¬Å¡Ã‚Â¬ÃƒÂ¢Ã¢â‚¬Å¾Ã‚Â¢ÃƒÆ’Ã†â€™Ãƒâ€ Ã¢â‚¬â„¢ÃƒÆ’Ã‚Â¢ÃƒÂ¢Ã¢â‚¬Å¡Ã‚Â¬Ãƒâ€¦Ã‚Â¡ÃƒÆ’Ã†â€™ÃƒÂ¢Ã¢â€šÂ¬Ã…Â¡ÃƒÆ’Ã¢â‚¬Å¡Ãƒâ€šÃ‚Â¢ÃƒÆ’Ã†â€™Ãƒâ€ Ã¢â‚¬â„¢ÃƒÆ’Ã¢â‚¬Â ÃƒÂ¢Ã¢â€šÂ¬Ã¢â€žÂ¢ÃƒÆ’Ã†â€™ÃƒÂ¢Ã¢â€šÂ¬Ã…Â¡ÃƒÆ’Ã¢â‚¬Å¡Ãƒâ€šÃ‚Â¢ÃƒÆ’Ã†â€™Ãƒâ€ Ã¢â‚¬â„¢ÃƒÆ’Ã¢â‚¬Å¡Ãƒâ€šÃ‚Â¢ÃƒÆ’Ã†â€™Ãƒâ€šÃ‚Â¢ÃƒÆ’Ã‚Â¢ÃƒÂ¢Ã¢â‚¬Å¡Ã‚Â¬Ãƒâ€¦Ã‚Â¡ÃƒÆ’Ã¢â‚¬Å¡Ãƒâ€šÃ‚Â¬ÃƒÆ’Ã†â€™ÃƒÂ¢Ã¢â€šÂ¬Ã‚Â¦ÃƒÆ’Ã¢â‚¬Å¡Ãƒâ€šÃ‚Â¡ÃƒÆ’Ã†â€™Ãƒâ€ Ã¢â‚¬â„¢ÃƒÆ’Ã‚Â¢ÃƒÂ¢Ã¢â‚¬Å¡Ã‚Â¬Ãƒâ€¦Ã‚Â¡ÃƒÆ’Ã†â€™ÃƒÂ¢Ã¢â€šÂ¬Ã…Â¡ÃƒÆ’Ã¢â‚¬Å¡Ãƒâ€šÃ‚Â¬ÃƒÆ’Ã†â€™Ãƒâ€ Ã¢â‚¬â„¢ÃƒÆ’Ã¢â‚¬Â ÃƒÂ¢Ã¢â€šÂ¬Ã¢â€žÂ¢ÃƒÆ’Ã†â€™Ãƒâ€šÃ‚Â¢ÃƒÆ’Ã‚Â¢ÃƒÂ¢Ã¢â€šÂ¬Ã…Â¡Ãƒâ€šÃ‚Â¬ÃƒÆ’Ã¢â‚¬Å¡Ãƒâ€šÃ‚Â¦ÃƒÆ’Ã†â€™Ãƒâ€ Ã¢â‚¬â„¢ÃƒÆ’Ã‚Â¢ÃƒÂ¢Ã¢â‚¬Å¡Ã‚Â¬Ãƒâ€¦Ã‚Â¡ÃƒÆ’Ã†â€™ÃƒÂ¢Ã¢â€šÂ¬Ã…Â¡ÃƒÆ’Ã¢â‚¬Å¡Ãƒâ€šÃ‚Â¡ÃƒÆ’Ã†â€™Ãƒâ€ Ã¢â‚¬â„¢ÃƒÆ’Ã¢â‚¬Â ÃƒÂ¢Ã¢â€šÂ¬Ã¢â€žÂ¢ÃƒÆ’Ã†â€™ÃƒÂ¢Ã¢â€šÂ¬Ã‚Â ÃƒÆ’Ã‚Â¢ÃƒÂ¢Ã¢â‚¬Å¡Ã‚Â¬ÃƒÂ¢Ã¢â‚¬Å¾Ã‚Â¢ÃƒÆ’Ã†â€™Ãƒâ€ Ã¢â‚¬â„¢ÃƒÆ’Ã‚Â¢ÃƒÂ¢Ã¢â‚¬Å¡Ã‚Â¬Ãƒâ€šÃ‚Â ÃƒÆ’Ã†â€™Ãƒâ€šÃ‚Â¢ÃƒÆ’Ã‚Â¢ÃƒÂ¢Ã¢â€šÂ¬Ã…Â¡Ãƒâ€šÃ‚Â¬ÃƒÆ’Ã‚Â¢ÃƒÂ¢Ã¢â€šÂ¬Ã…Â¾Ãƒâ€šÃ‚Â¢ÃƒÆ’Ã†â€™Ãƒâ€ Ã¢â‚¬â„¢ÃƒÆ’Ã¢â‚¬Â ÃƒÂ¢Ã¢â€šÂ¬Ã¢â€žÂ¢ÃƒÆ’Ã†â€™ÃƒÂ¢Ã¢â€šÂ¬Ã…Â¡ÃƒÆ’Ã¢â‚¬Å¡Ãƒâ€šÃ‚Â¢ÃƒÆ’Ã†â€™Ãƒâ€ Ã¢â‚¬â„¢ÃƒÆ’Ã¢â‚¬Å¡Ãƒâ€šÃ‚Â¢ÃƒÆ’Ã†â€™Ãƒâ€šÃ‚Â¢ÃƒÆ’Ã‚Â¢ÃƒÂ¢Ã¢â€šÂ¬Ã…Â¡Ãƒâ€šÃ‚Â¬ÃƒÆ’Ã¢â‚¬Â¦Ãƒâ€šÃ‚Â¡ÃƒÆ’Ã†â€™ÃƒÂ¢Ã¢â€šÂ¬Ã…Â¡ÃƒÆ’Ã¢â‚¬Å¡Ãƒâ€šÃ‚Â¬ÃƒÆ’Ã†â€™Ãƒâ€ Ã¢â‚¬â„¢ÃƒÆ’Ã‚Â¢ÃƒÂ¢Ã¢â‚¬Å¡Ã‚Â¬Ãƒâ€šÃ‚Â¦ÃƒÆ’Ã†â€™ÃƒÂ¢Ã¢â€šÂ¬Ã…Â¡ÃƒÆ’Ã¢â‚¬Å¡Ãƒâ€šÃ‚Â¡ÃƒÆ’Ã†â€™Ãƒâ€ Ã¢â‚¬â„¢ÃƒÆ’Ã¢â‚¬Â ÃƒÂ¢Ã¢â€šÂ¬Ã¢â€žÂ¢ÃƒÆ’Ã†â€™ÃƒÂ¢Ã¢â€šÂ¬Ã‚Â ÃƒÆ’Ã‚Â¢ÃƒÂ¢Ã¢â‚¬Å¡Ã‚Â¬ÃƒÂ¢Ã¢â‚¬Å¾Ã‚Â¢ÃƒÆ’Ã†â€™Ãƒâ€ Ã¢â‚¬â„¢ÃƒÆ’Ã¢â‚¬Å¡Ãƒâ€šÃ‚Â¢ÃƒÆ’Ã†â€™Ãƒâ€šÃ‚Â¢ÃƒÆ’Ã‚Â¢ÃƒÂ¢Ã¢â‚¬Å¡Ã‚Â¬Ãƒâ€¦Ã‚Â¡ÃƒÆ’Ã¢â‚¬Å¡Ãƒâ€šÃ‚Â¬ÃƒÆ’Ã†â€™ÃƒÂ¢Ã¢â€šÂ¬Ã‚Â¦ÃƒÆ’Ã¢â‚¬Å¡Ãƒâ€šÃ‚Â¡ÃƒÆ’Ã†â€™Ãƒâ€ Ã¢â‚¬â„¢ÃƒÆ’Ã¢â‚¬Â ÃƒÂ¢Ã¢â€šÂ¬Ã¢â€žÂ¢ÃƒÆ’Ã†â€™Ãƒâ€šÃ‚Â¢ÃƒÆ’Ã‚Â¢ÃƒÂ¢Ã¢â€šÂ¬Ã…Â¡Ãƒâ€šÃ‚Â¬ÃƒÆ’Ã¢â‚¬Â¦Ãƒâ€šÃ‚Â¡ÃƒÆ’Ã†â€™Ãƒâ€ Ã¢â‚¬â„¢ÃƒÆ’Ã‚Â¢ÃƒÂ¢Ã¢â‚¬Å¡Ã‚Â¬Ãƒâ€¦Ã‚Â¡ÃƒÆ’Ã†â€™ÃƒÂ¢Ã¢â€šÂ¬Ã…Â¡ÃƒÆ’Ã¢â‚¬Å¡Ãƒâ€šÃ‚Â¼g</w:t>
       </w:r>
       <w:proofErr w:type="spellEnd"/>
       <w:r>
@@ -9170,7 +9170,7 @@
           <w:sz w:val="28"/>
           <w:szCs w:val="28"/>
         </w:rPr>
-        <w:t>ÃƒÆ’Ã†â€™Ãƒâ€ Ã¢â‚¬â„¢ÃƒÆ’Ã¢â‚¬Â ÃƒÂ¢Ã¢â€šÂ¬Ã¢â€žÂ¢ÃƒÆ’Ã†â€™ÃƒÂ¢Ã¢â€šÂ¬Ã‚Â ÃƒÆ’Ã‚Â¢ÃƒÂ¢Ã¢â‚¬Å¡Ã‚Â¬ÃƒÂ¢Ã¢â‚¬Å¾Ã‚Â¢ÃƒÆ’Ã†â€™Ãƒâ€ Ã¢â‚¬â„¢ÃƒÆ’Ã‚Â¢ÃƒÂ¢Ã¢â‚¬Å¡Ã‚Â¬Ãƒâ€šÃ‚Â ÃƒÆ’Ã†â€™Ãƒâ€šÃ‚Â¢ÃƒÆ’Ã‚Â¢ÃƒÂ¢Ã¢â€šÂ¬Ã…Â¡Ãƒâ€šÃ‚Â¬ÃƒÆ’Ã‚Â¢ÃƒÂ¢Ã¢â€šÂ¬Ã…Â¾Ãƒâ€šÃ‚Â¢ÃƒÆ’Ã†â€™Ãƒâ€ Ã¢â‚¬â„¢ÃƒÆ’Ã¢â‚¬Â ÃƒÂ¢Ã¢â€šÂ¬Ã¢â€žÂ¢ÃƒÆ’Ã†â€™Ãƒâ€šÃ‚Â¢ÃƒÆ’Ã‚Â¢ÃƒÂ¢Ã¢â€šÂ¬Ã…Â¡Ãƒâ€šÃ‚Â¬ÃƒÆ’Ã¢â‚¬Å¡Ãƒâ€šÃ‚Â ÃƒÆ’Ã†â€™Ãƒâ€ Ã¢â‚¬â„¢ÃƒÆ’Ã¢â‚¬Å¡Ãƒâ€šÃ‚Â¢ÃƒÆ’Ã†â€™Ãƒâ€šÃ‚Â¢ÃƒÆ’Ã‚Â¢ÃƒÂ¢Ã¢â‚¬Å¡Ã‚Â¬Ãƒâ€¦Ã‚Â¡ÃƒÆ’Ã¢â‚¬Å¡Ãƒâ€šÃ‚Â¬ÃƒÆ’Ã†â€™Ãƒâ€šÃ‚Â¢ÃƒÆ’Ã‚Â¢ÃƒÂ¢Ã¢â‚¬Å¡Ã‚Â¬Ãƒâ€¦Ã‚Â¾ÃƒÆ’Ã¢â‚¬Å¡Ãƒâ€šÃ‚Â¢ÃƒÆ’Ã†â€™Ãƒâ€ Ã¢â‚¬â„¢ÃƒÆ’Ã¢â‚¬Â ÃƒÂ¢Ã¢â€šÂ¬Ã¢â€žÂ¢ÃƒÆ’Ã†â€™ÃƒÂ¢Ã¢â€šÂ¬Ã‚Â ÃƒÆ’Ã‚Â¢ÃƒÂ¢Ã¢â‚¬Å¡Ã‚Â¬ÃƒÂ¢Ã¢â‚¬Å¾Ã‚Â¢ÃƒÆ’Ã†â€™Ãƒâ€ Ã¢â‚¬â„¢ÃƒÆ’Ã¢â‚¬Å¡Ãƒâ€šÃ‚Â¢ÃƒÆ’Ã†â€™Ãƒâ€šÃ‚Â¢ÃƒÆ’Ã‚Â¢ÃƒÂ¢Ã¢â‚¬Å¡Ã‚Â¬Ãƒâ€¦Ã‚Â¡ÃƒÆ’Ã¢â‚¬Å¡Ãƒâ€šÃ‚Â¬ÃƒÆ’Ã†â€™ÃƒÂ¢Ã¢â€šÂ¬Ã…Â¡ÃƒÆ’Ã¢â‚¬Å¡Ãƒâ€šÃ‚Â¦ÃƒÆ’Ã†â€™Ãƒâ€ Ã¢â‚¬â„¢ÃƒÆ’Ã¢â‚¬Â ÃƒÂ¢Ã¢â€šÂ¬Ã¢â€žÂ¢ÃƒÆ’Ã†â€™Ãƒâ€šÃ‚Â¢ÃƒÆ’Ã‚Â¢ÃƒÂ¢Ã¢â€šÂ¬Ã…Â¡Ãƒâ€šÃ‚Â¬ÃƒÆ’Ã¢â‚¬Â¦Ãƒâ€šÃ‚Â¡ÃƒÆ’Ã†â€™Ãƒâ€ Ã¢â‚¬â„¢ÃƒÆ’Ã‚Â¢ÃƒÂ¢Ã¢â‚¬Å¡Ã‚Â¬Ãƒâ€¦Ã‚Â¡ÃƒÆ’Ã†â€™ÃƒÂ¢Ã¢â€šÂ¬Ã…Â¡ÃƒÆ’Ã¢â‚¬Å¡Ãƒâ€šÃ‚Â½ÃƒÆ’Ã†â€™Ãƒâ€ Ã¢â‚¬â„¢ÃƒÆ’Ã¢â‚¬Â ÃƒÂ¢Ã¢â€šÂ¬Ã¢â€žÂ¢ÃƒÆ’Ã†â€™ÃƒÂ¢Ã¢â€šÂ¬Ã‚Â ÃƒÆ’Ã‚Â¢ÃƒÂ¢Ã¢â‚¬Å¡Ã‚Â¬ÃƒÂ¢Ã¢â‚¬Å¾Ã‚Â¢ÃƒÆ’Ã†â€™Ãƒâ€ Ã¢â‚¬â„¢ÃƒÆ’Ã‚Â¢ÃƒÂ¢Ã¢â‚¬Å¡Ã‚Â¬Ãƒâ€šÃ‚Â ÃƒÆ’Ã†â€™Ãƒâ€šÃ‚Â¢ÃƒÆ’Ã‚Â¢ÃƒÂ¢Ã¢â€šÂ¬Ã…Â¡Ãƒâ€šÃ‚Â¬ÃƒÆ’Ã‚Â¢ÃƒÂ¢Ã¢â€šÂ¬Ã…Â¾Ãƒâ€šÃ‚Â¢ÃƒÆ’Ã†â€™Ãƒâ€ Ã¢â‚¬â„¢ÃƒÆ’Ã¢â‚¬Â ÃƒÂ¢Ã¢â€šÂ¬Ã¢â€žÂ¢ÃƒÆ’Ã†â€™ÃƒÂ¢Ã¢â€šÂ¬Ã…Â¡ÃƒÆ’Ã¢â‚¬Å¡Ãƒâ€šÃ‚Â¢ÃƒÆ’Ã†â€™Ãƒâ€ Ã¢â‚¬â„¢ÃƒÆ’Ã¢â‚¬Å¡Ãƒâ€šÃ‚Â¢ÃƒÆ’Ã†â€™Ãƒâ€šÃ‚Â¢ÃƒÆ’Ã‚Â¢ÃƒÂ¢Ã¢â€šÂ¬Ã…Â¡Ãƒâ€šÃ‚Â¬ÃƒÆ’Ã¢â‚¬Â¦Ãƒâ€šÃ‚Â¡ÃƒÆ’Ã†â€™ÃƒÂ¢Ã¢â€šÂ¬Ã…Â¡ÃƒÆ’Ã¢â‚¬Å¡Ãƒâ€šÃ‚Â¬ÃƒÆ’Ã†â€™Ãƒâ€ Ã¢â‚¬â„¢ÃƒÆ’Ã‚Â¢ÃƒÂ¢Ã¢â‚¬Å¡Ã‚Â¬Ãƒâ€šÃ‚Â¦ÃƒÆ’Ã†â€™ÃƒÂ¢Ã¢â€šÂ¬Ã…Â¡ÃƒÆ’Ã¢â‚¬Å¡Ãƒâ€šÃ‚Â¡ÃƒÆ’Ã†â€™Ãƒâ€ Ã¢â‚¬â„¢ÃƒÆ’Ã¢â‚¬Â ÃƒÂ¢Ã¢â€šÂ¬Ã¢â€žÂ¢ÃƒÆ’Ã†â€™ÃƒÂ¢Ã¢â€šÂ¬Ã‚Â ÃƒÆ’Ã‚Â¢ÃƒÂ¢Ã¢â‚¬Å¡Ã‚Â¬ÃƒÂ¢Ã¢â‚¬Å¾Ã‚Â¢ÃƒÆ’Ã†â€™Ãƒâ€ Ã¢â‚¬â„¢ÃƒÆ’Ã¢â‚¬Å¡Ãƒâ€šÃ‚Â¢ÃƒÆ’Ã†â€™Ãƒâ€šÃ‚Â¢ÃƒÆ’Ã‚Â¢ÃƒÂ¢Ã¢â‚¬Å¡Ã‚Â¬Ãƒâ€¦Ã‚Â¡ÃƒÆ’Ã¢â‚¬Å¡Ãƒâ€šÃ‚Â¬ÃƒÆ’Ã†â€™ÃƒÂ¢Ã¢â€šÂ¬Ã‚Â¦ÃƒÆ’Ã¢â‚¬Å¡Ãƒâ€šÃ‚Â¡ÃƒÆ’Ã†â€™Ãƒâ€ Ã¢â‚¬â„¢ÃƒÆ’Ã¢â‚¬Â ÃƒÂ¢Ã¢â€šÂ¬Ã¢â€žÂ¢ÃƒÆ’Ã†â€™Ãƒâ€šÃ‚Â¢ÃƒÆ’Ã‚Â¢ÃƒÂ¢Ã¢â€šÂ¬Ã…Â¡Ãƒâ€šÃ‚Â¬ÃƒÆ’Ã¢â‚¬Â¦Ãƒâ€šÃ‚Â¡ÃƒÆ’Ã†â€™Ãƒâ€ Ã¢â‚¬â„¢ÃƒÆ’Ã‚Â¢ÃƒÂ¢Ã¢â‚¬Å¡Ã‚Â¬Ãƒâ€¦Ã‚Â¡ÃƒÆ’Ã†â€™ÃƒÂ¢Ã¢â€šÂ¬Ã…Â¡ÃƒÆ’Ã¢â‚¬Å¡Ãƒâ€šÃ‚Â¼g</w:t>
+        <w:t>ÃƒÆ’Ã†â€™Ãƒâ€ Ã¢â‚¬â„¢ÃƒÆ’Ã¢â‚¬Â ÃƒÂ¢Ã¢â€šÂ¬Ã¢â€žÂ¢ÃƒÆ’Ã†â€™ÃƒÂ¢Ã¢â€šÂ¬Ã‚Â ÃƒÆ’Ã‚Â¢ÃƒÂ¢Ã¢â‚¬Å¡Ã‚Â¬ÃƒÂ¢Ã¢â‚¬Å¾Ã‚Â¢ÃƒÆ’Ã†â€™Ãƒâ€ Ã¢â‚¬â„¢ÃƒÆ’Ã‚Â¢ÃƒÂ¢Ã¢â‚¬Å¡Ã‚Â¬Ãƒâ€šÃ‚Â ÃƒÆ’Ã†â€™Ãƒâ€šÃ‚Â¢ÃƒÆ’Ã‚Â¢ÃƒÂ¢Ã¢â€šÂ¬Ã…Â¡Ãƒâ€šÃ‚Â¬ÃƒÆ’Ã‚Â¢ÃƒÂ¢Ã¢â€šÂ¬Ã…Â¾Ãƒâ€šÃ‚Â¢ÃƒÆ’Ã†â€™Ãƒâ€ Ã¢â‚¬â„¢ÃƒÆ’Ã¢â‚¬Â ÃƒÂ¢Ã¢â€šÂ¬Ã¢â€žÂ¢ÃƒÆ’Ã†â€™Ãƒâ€šÃ‚Â¢ÃƒÆ’Ã‚Â¢ÃƒÂ¢Ã¢â€šÂ¬Ã…Â¡Ãƒâ€šÃ‚Â¬ÃƒÆ’Ã¢â‚¬Å¡Ãƒâ€šÃ‚Â ÃƒÆ’Ã†â€™Ãƒâ€ Ã¢â‚¬â„¢ÃƒÆ’Ã¢â‚¬Å¡Ãƒâ€šÃ‚Â¢ÃƒÆ’Ã†â€™Ãƒâ€šÃ‚Â¢ÃƒÆ’Ã‚Â¢ÃƒÂ¢Ã¢â‚¬Å¡Ã‚Â¬Ãƒâ€¦Ã‚Â¡ÃƒÆ’Ã¢â‚¬Å¡Ãƒâ€šÃ‚Â¬ÃƒÆ’Ã†â€™Ãƒâ€šÃ‚Â¢ÃƒÆ’Ã‚Â¢ÃƒÂ¢Ã¢â‚¬Å¡Ã‚Â¬Ãƒâ€¦Ã‚Â¾ÃƒÆ’Ã¢â‚¬Å¡Ãƒâ€šÃ‚Â¢ÃƒÆ’Ã†â€™Ãƒâ€ Ã¢â‚¬â„¢ÃƒÆ’Ã¢â‚¬Â ÃƒÂ¢Ã¢â€šÂ¬Ã¢â€žÂ¢ÃƒÆ’Ã†â€™ÃƒÂ¢Ã¢â€šÂ¬Ã‚Â ÃƒÆ’Ã‚Â¢ÃƒÂ¢Ã¢â‚¬Å¡Ã‚Â¬ÃƒÂ¢Ã¢â‚¬Å¾Ã‚Â¢ÃƒÆ’Ã†â€™Ãƒâ€ Ã¢â‚¬â„¢ÃƒÆ’Ã¢â‚¬Å¡Ãƒâ€šÃ‚Â¢ÃƒÆ’Ã†â€™Ãƒâ€šÃ‚Â¢ÃƒÆ’Ã‚Â¢ÃƒÂ¢Ã¢â‚¬Å¡Ã‚Â¬Ãƒâ€¦Ã‚Â¡ÃƒÆ’Ã¢â‚¬Å¡Ãƒâ€šÃ‚Â¬ÃƒÆ’Ã†â€™ÃƒÂ¢Ã¢â€šÂ¬Ã…Â¡ÃƒÆ’Ã¢â‚¬Å¡Ãƒâ€šÃ‚Â ÃƒÆ’Ã†â€™Ãƒâ€ Ã¢â‚¬â„¢ÃƒÆ’Ã¢â‚¬Â ÃƒÂ¢Ã¢â€šÂ¬Ã¢â€žÂ¢ÃƒÆ’Ã†â€™ÃƒÂ¢Ã¢â€šÂ¬Ã…Â¡ÃƒÆ’Ã¢â‚¬Å¡Ãƒâ€šÃ‚Â¢ÃƒÆ’Ã†â€™Ãƒâ€ Ã¢â‚¬â„¢ÃƒÆ’Ã¢â‚¬Å¡Ãƒâ€šÃ‚Â¢ÃƒÆ’Ã†â€™Ãƒâ€šÃ‚Â¢ÃƒÆ’Ã‚Â¢ÃƒÂ¢Ã¢â€šÂ¬Ã…Â¡Ãƒâ€šÃ‚Â¬ÃƒÆ’Ã¢â‚¬Â¦Ãƒâ€šÃ‚Â¡ÃƒÆ’Ã†â€™ÃƒÂ¢Ã¢â€šÂ¬Ã…Â¡ÃƒÆ’Ã¢â‚¬Å¡Ãƒâ€šÃ‚Â¬ÃƒÆ’Ã†â€™Ãƒâ€ Ã¢â‚¬â„¢ÃƒÆ’Ã¢â‚¬Å¡Ãƒâ€šÃ‚Â¢ÃƒÆ’Ã†â€™Ãƒâ€šÃ‚Â¢ÃƒÆ’Ã‚Â¢ÃƒÂ¢Ã¢â€šÂ¬Ã…Â¡Ãƒâ€šÃ‚Â¬ÃƒÆ’Ã¢â‚¬Â¦Ãƒâ€šÃ‚Â¾ÃƒÆ’Ã†â€™ÃƒÂ¢Ã¢â€šÂ¬Ã…Â¡ÃƒÆ’Ã¢â‚¬Å¡Ãƒâ€šÃ‚Â¢ÃƒÆ’Ã†â€™Ãƒâ€ Ã¢â‚¬â„¢ÃƒÆ’Ã¢â‚¬Â ÃƒÂ¢Ã¢â€šÂ¬Ã¢â€žÂ¢ÃƒÆ’Ã†â€™ÃƒÂ¢Ã¢â€šÂ¬Ã‚Â ÃƒÆ’Ã‚Â¢ÃƒÂ¢Ã¢â‚¬Å¡Ã‚Â¬ÃƒÂ¢Ã¢â‚¬Å¾Ã‚Â¢ÃƒÆ’Ã†â€™Ãƒâ€ Ã¢â‚¬â„¢ÃƒÆ’Ã‚Â¢ÃƒÂ¢Ã¢â‚¬Å¡Ã‚Â¬Ãƒâ€šÃ‚Â ÃƒÆ’Ã†â€™Ãƒâ€šÃ‚Â¢ÃƒÆ’Ã‚Â¢ÃƒÂ¢Ã¢â€šÂ¬Ã…Â¡Ãƒâ€šÃ‚Â¬ÃƒÆ’Ã‚Â¢ÃƒÂ¢Ã¢â€šÂ¬Ã…Â¾Ãƒâ€šÃ‚Â¢ÃƒÆ’Ã†â€™Ãƒâ€ Ã¢â‚¬â„¢ÃƒÆ’Ã¢â‚¬Â ÃƒÂ¢Ã¢â€šÂ¬Ã¢â€žÂ¢ÃƒÆ’Ã†â€™ÃƒÂ¢Ã¢â€šÂ¬Ã…Â¡ÃƒÆ’Ã¢â‚¬Å¡Ãƒâ€šÃ‚Â¢ÃƒÆ’Ã†â€™Ãƒâ€ Ã¢â‚¬â„¢ÃƒÆ’Ã¢â‚¬Å¡Ãƒâ€šÃ‚Â¢ÃƒÆ’Ã†â€™Ãƒâ€šÃ‚Â¢ÃƒÆ’Ã‚Â¢ÃƒÂ¢Ã¢â€šÂ¬Ã…Â¡Ãƒâ€šÃ‚Â¬ÃƒÆ’Ã¢â‚¬Â¦Ãƒâ€šÃ‚Â¡ÃƒÆ’Ã†â€™ÃƒÂ¢Ã¢â€šÂ¬Ã…Â¡ÃƒÆ’Ã¢â‚¬Å¡Ãƒâ€šÃ‚Â¬ÃƒÆ’Ã†â€™Ãƒâ€ Ã¢â‚¬â„¢ÃƒÆ’Ã‚Â¢ÃƒÂ¢Ã¢â‚¬Å¡Ã‚Â¬Ãƒâ€¦Ã‚Â¡ÃƒÆ’Ã†â€™ÃƒÂ¢Ã¢â€šÂ¬Ã…Â¡ÃƒÆ’Ã¢â‚¬Å¡Ãƒâ€šÃ‚Â¦ÃƒÆ’Ã†â€™Ãƒâ€ Ã¢â‚¬â„¢ÃƒÆ’Ã¢â‚¬Â ÃƒÂ¢Ã¢â€šÂ¬Ã¢â€žÂ¢ÃƒÆ’Ã†â€™ÃƒÂ¢Ã¢â€šÂ¬Ã‚Â ÃƒÆ’Ã‚Â¢ÃƒÂ¢Ã¢â‚¬Å¡Ã‚Â¬ÃƒÂ¢Ã¢â‚¬Å¾Ã‚Â¢ÃƒÆ’Ã†â€™Ãƒâ€ Ã¢â‚¬â„¢ÃƒÆ’Ã¢â‚¬Å¡Ãƒâ€šÃ‚Â¢ÃƒÆ’Ã†â€™Ãƒâ€šÃ‚Â¢ÃƒÆ’Ã‚Â¢ÃƒÂ¢Ã¢â‚¬Å¡Ã‚Â¬Ãƒâ€¦Ã‚Â¡ÃƒÆ’Ã¢â‚¬Å¡Ãƒâ€šÃ‚Â¬ÃƒÆ’Ã†â€™ÃƒÂ¢Ã¢â€šÂ¬Ã‚Â¦ÃƒÆ’Ã¢â‚¬Å¡Ãƒâ€šÃ‚Â¡ÃƒÆ’Ã†â€™Ãƒâ€ Ã¢â‚¬â„¢ÃƒÆ’Ã¢â‚¬Â ÃƒÂ¢Ã¢â€šÂ¬Ã¢â€žÂ¢ÃƒÆ’Ã†â€™Ãƒâ€šÃ‚Â¢ÃƒÆ’Ã‚Â¢ÃƒÂ¢Ã¢â€šÂ¬Ã…Â¡Ãƒâ€šÃ‚Â¬ÃƒÆ’Ã¢â‚¬Â¦Ãƒâ€šÃ‚Â¡ÃƒÆ’Ã†â€™Ãƒâ€ Ã¢â‚¬â„¢ÃƒÆ’Ã‚Â¢ÃƒÂ¢Ã¢â‚¬Å¡Ã‚Â¬Ãƒâ€¦Ã‚Â¡ÃƒÆ’Ã†â€™ÃƒÂ¢Ã¢â€šÂ¬Ã…Â¡ÃƒÆ’Ã¢â‚¬Å¡Ãƒâ€šÃ‚Â½ÃƒÆ’Ã†â€™Ãƒâ€ Ã¢â‚¬â„¢ÃƒÆ’Ã¢â‚¬Â ÃƒÂ¢Ã¢â€šÂ¬Ã¢â€žÂ¢ÃƒÆ’Ã†â€™ÃƒÂ¢Ã¢â€šÂ¬Ã‚Â ÃƒÆ’Ã‚Â¢ÃƒÂ¢Ã¢â‚¬Å¡Ã‚Â¬ÃƒÂ¢Ã¢â‚¬Å¾Ã‚Â¢ÃƒÆ’Ã†â€™Ãƒâ€ Ã¢â‚¬â„¢ÃƒÆ’Ã‚Â¢ÃƒÂ¢Ã¢â‚¬Å¡Ã‚Â¬Ãƒâ€šÃ‚Â ÃƒÆ’Ã†â€™Ãƒâ€šÃ‚Â¢ÃƒÆ’Ã‚Â¢ÃƒÂ¢Ã¢â€šÂ¬Ã…Â¡Ãƒâ€šÃ‚Â¬ÃƒÆ’Ã‚Â¢ÃƒÂ¢Ã¢â€šÂ¬Ã…Â¾Ãƒâ€šÃ‚Â¢ÃƒÆ’Ã†â€™Ãƒâ€ Ã¢â‚¬â„¢ÃƒÆ’Ã¢â‚¬Â ÃƒÂ¢Ã¢â€šÂ¬Ã¢â€žÂ¢ÃƒÆ’Ã†â€™Ãƒâ€šÃ‚Â¢ÃƒÆ’Ã‚Â¢ÃƒÂ¢Ã¢â€šÂ¬Ã…Â¡Ãƒâ€šÃ‚Â¬ÃƒÆ’Ã¢â‚¬Å¡Ãƒâ€šÃ‚Â ÃƒÆ’Ã†â€™Ãƒâ€ Ã¢â‚¬â„¢ÃƒÆ’Ã¢â‚¬Å¡Ãƒâ€šÃ‚Â¢ÃƒÆ’Ã†â€™Ãƒâ€šÃ‚Â¢ÃƒÆ’Ã‚Â¢ÃƒÂ¢Ã¢â‚¬Å¡Ã‚Â¬Ãƒâ€¦Ã‚Â¡ÃƒÆ’Ã¢â‚¬Å¡Ãƒâ€šÃ‚Â¬ÃƒÆ’Ã†â€™Ãƒâ€šÃ‚Â¢ÃƒÆ’Ã‚Â¢ÃƒÂ¢Ã¢â‚¬Å¡Ã‚Â¬Ãƒâ€¦Ã‚Â¾ÃƒÆ’Ã¢â‚¬Å¡Ãƒâ€šÃ‚Â¢ÃƒÆ’Ã†â€™Ãƒâ€ Ã¢â‚¬â„¢ÃƒÆ’Ã¢â‚¬Â ÃƒÂ¢Ã¢â€šÂ¬Ã¢â€žÂ¢ÃƒÆ’Ã†â€™ÃƒÂ¢Ã¢â€šÂ¬Ã‚Â ÃƒÆ’Ã‚Â¢ÃƒÂ¢Ã¢â‚¬Å¡Ã‚Â¬ÃƒÂ¢Ã¢â‚¬Å¾Ã‚Â¢ÃƒÆ’Ã†â€™Ãƒâ€ Ã¢â‚¬â„¢ÃƒÆ’Ã‚Â¢ÃƒÂ¢Ã¢â‚¬Å¡Ã‚Â¬Ãƒâ€¦Ã‚Â¡ÃƒÆ’Ã†â€™ÃƒÂ¢Ã¢â€šÂ¬Ã…Â¡ÃƒÆ’Ã¢â‚¬Å¡Ãƒâ€šÃ‚Â¢ÃƒÆ’Ã†â€™Ãƒâ€ Ã¢â‚¬â„¢ÃƒÆ’Ã¢â‚¬Â ÃƒÂ¢Ã¢â€šÂ¬Ã¢â€žÂ¢ÃƒÆ’Ã†â€™ÃƒÂ¢Ã¢â€šÂ¬Ã…Â¡ÃƒÆ’Ã¢â‚¬Å¡Ãƒâ€šÃ‚Â¢ÃƒÆ’Ã†â€™Ãƒâ€ Ã¢â‚¬â„¢ÃƒÆ’Ã¢â‚¬Å¡Ãƒâ€šÃ‚Â¢ÃƒÆ’Ã†â€™Ãƒâ€šÃ‚Â¢ÃƒÆ’Ã‚Â¢ÃƒÂ¢Ã¢â‚¬Å¡Ã‚Â¬Ãƒâ€¦Ã‚Â¡ÃƒÆ’Ã¢â‚¬Å¡Ãƒâ€šÃ‚Â¬ÃƒÆ’Ã†â€™ÃƒÂ¢Ã¢â€šÂ¬Ã‚Â¦ÃƒÆ’Ã¢â‚¬Å¡Ãƒâ€šÃ‚Â¡ÃƒÆ’Ã†â€™Ãƒâ€ Ã¢â‚¬â„¢ÃƒÆ’Ã‚Â¢ÃƒÂ¢Ã¢â‚¬Å¡Ã‚Â¬Ãƒâ€¦Ã‚Â¡ÃƒÆ’Ã†â€™ÃƒÂ¢Ã¢â€šÂ¬Ã…Â¡ÃƒÆ’Ã¢â‚¬Å¡Ãƒâ€šÃ‚Â¬ÃƒÆ’Ã†â€™Ãƒâ€ Ã¢â‚¬â„¢ÃƒÆ’Ã¢â‚¬Â ÃƒÂ¢Ã¢â€šÂ¬Ã¢â€žÂ¢ÃƒÆ’Ã†â€™Ãƒâ€šÃ‚Â¢ÃƒÆ’Ã‚Â¢ÃƒÂ¢Ã¢â€šÂ¬Ã…Â¡Ãƒâ€šÃ‚Â¬ÃƒÆ’Ã¢â‚¬Å¡Ãƒâ€šÃ‚Â¦ÃƒÆ’Ã†â€™Ãƒâ€ Ã¢â‚¬â„¢ÃƒÆ’Ã‚Â¢ÃƒÂ¢Ã¢â‚¬Å¡Ã‚Â¬Ãƒâ€¦Ã‚Â¡ÃƒÆ’Ã†â€™ÃƒÂ¢Ã¢â€šÂ¬Ã…Â¡ÃƒÆ’Ã¢â‚¬Å¡Ãƒâ€šÃ‚Â¡ÃƒÆ’Ã†â€™Ãƒâ€ Ã¢â‚¬â„¢ÃƒÆ’Ã¢â‚¬Â ÃƒÂ¢Ã¢â€šÂ¬Ã¢â€žÂ¢ÃƒÆ’Ã†â€™ÃƒÂ¢Ã¢â€šÂ¬Ã‚Â ÃƒÆ’Ã‚Â¢ÃƒÂ¢Ã¢â‚¬Å¡Ã‚Â¬ÃƒÂ¢Ã¢â‚¬Å¾Ã‚Â¢ÃƒÆ’Ã†â€™Ãƒâ€ Ã¢â‚¬â„¢ÃƒÆ’Ã‚Â¢ÃƒÂ¢Ã¢â‚¬Å¡Ã‚Â¬Ãƒâ€šÃ‚Â ÃƒÆ’Ã†â€™Ãƒâ€šÃ‚Â¢ÃƒÆ’Ã‚Â¢ÃƒÂ¢Ã¢â€šÂ¬Ã…Â¡Ãƒâ€šÃ‚Â¬ÃƒÆ’Ã‚Â¢ÃƒÂ¢Ã¢â€šÂ¬Ã…Â¾Ãƒâ€šÃ‚Â¢ÃƒÆ’Ã†â€™Ãƒâ€ Ã¢â‚¬â„¢ÃƒÆ’Ã¢â‚¬Â ÃƒÂ¢Ã¢â€šÂ¬Ã¢â€žÂ¢ÃƒÆ’Ã†â€™ÃƒÂ¢Ã¢â€šÂ¬Ã…Â¡ÃƒÆ’Ã¢â‚¬Å¡Ãƒâ€šÃ‚Â¢ÃƒÆ’Ã†â€™Ãƒâ€ Ã¢â‚¬â„¢ÃƒÆ’Ã¢â‚¬Å¡Ãƒâ€šÃ‚Â¢ÃƒÆ’Ã†â€™Ãƒâ€šÃ‚Â¢ÃƒÆ’Ã‚Â¢ÃƒÂ¢Ã¢â€šÂ¬Ã…Â¡Ãƒâ€šÃ‚Â¬ÃƒÆ’Ã¢â‚¬Â¦Ãƒâ€šÃ‚Â¡ÃƒÆ’Ã†â€™ÃƒÂ¢Ã¢â€šÂ¬Ã…Â¡ÃƒÆ’Ã¢â‚¬Å¡Ãƒâ€šÃ‚Â¬ÃƒÆ’Ã†â€™Ãƒâ€ Ã¢â‚¬â„¢ÃƒÆ’Ã‚Â¢ÃƒÂ¢Ã¢â‚¬Å¡Ã‚Â¬Ãƒâ€šÃ‚Â¦ÃƒÆ’Ã†â€™ÃƒÂ¢Ã¢â€šÂ¬Ã…Â¡ÃƒÆ’Ã¢â‚¬Å¡Ãƒâ€šÃ‚Â¡ÃƒÆ’Ã†â€™Ãƒâ€ Ã¢â‚¬â„¢ÃƒÆ’Ã¢â‚¬Â ÃƒÂ¢Ã¢â€šÂ¬Ã¢â€žÂ¢ÃƒÆ’Ã†â€™ÃƒÂ¢Ã¢â€šÂ¬Ã‚Â ÃƒÆ’Ã‚Â¢ÃƒÂ¢Ã¢â‚¬Å¡Ã‚Â¬ÃƒÂ¢Ã¢â‚¬Å¾Ã‚Â¢ÃƒÆ’Ã†â€™Ãƒâ€ Ã¢â‚¬â„¢ÃƒÆ’Ã¢â‚¬Å¡Ãƒâ€šÃ‚Â¢ÃƒÆ’Ã†â€™Ãƒâ€šÃ‚Â¢ÃƒÆ’Ã‚Â¢ÃƒÂ¢Ã¢â‚¬Å¡Ã‚Â¬Ãƒâ€¦Ã‚Â¡ÃƒÆ’Ã¢â‚¬Å¡Ãƒâ€šÃ‚Â¬ÃƒÆ’Ã†â€™ÃƒÂ¢Ã¢â€šÂ¬Ã‚Â¦ÃƒÆ’Ã¢â‚¬Å¡Ãƒâ€šÃ‚Â¡ÃƒÆ’Ã†â€™Ãƒâ€ Ã¢â‚¬â„¢ÃƒÆ’Ã¢â‚¬Â ÃƒÂ¢Ã¢â€šÂ¬Ã¢â€žÂ¢ÃƒÆ’Ã†â€™Ãƒâ€šÃ‚Â¢ÃƒÆ’Ã‚Â¢ÃƒÂ¢Ã¢â€šÂ¬Ã…Â¡Ãƒâ€šÃ‚Â¬ÃƒÆ’Ã¢â‚¬Â¦Ãƒâ€šÃ‚Â¡ÃƒÆ’Ã†â€™Ãƒâ€ Ã¢â‚¬â„¢ÃƒÆ’Ã‚Â¢ÃƒÂ¢Ã¢â‚¬Å¡Ã‚Â¬Ãƒâ€¦Ã‚Â¡ÃƒÆ’Ã†â€™ÃƒÂ¢Ã¢â€šÂ¬Ã…Â¡ÃƒÆ’Ã¢â‚¬Å¡Ãƒâ€šÃ‚Â¼g</w:t>
       </w:r>
       <w:proofErr w:type="spellEnd"/>
       <w:r>
@@ -9188,7 +9188,7 @@
           <w:sz w:val="28"/>
           <w:szCs w:val="28"/>
         </w:rPr>
-        <w:t>ÃƒÆ’Ã†â€™Ãƒâ€ Ã¢â‚¬â„¢ÃƒÆ’Ã¢â‚¬Â ÃƒÂ¢Ã¢â€šÂ¬Ã¢â€žÂ¢ÃƒÆ’Ã†â€™ÃƒÂ¢Ã¢â€šÂ¬Ã‚Â ÃƒÆ’Ã‚Â¢ÃƒÂ¢Ã¢â‚¬Å¡Ã‚Â¬ÃƒÂ¢Ã¢â‚¬Å¾Ã‚Â¢ÃƒÆ’Ã†â€™Ãƒâ€ Ã¢â‚¬â„¢ÃƒÆ’Ã‚Â¢ÃƒÂ¢Ã¢â‚¬Å¡Ã‚Â¬Ãƒâ€šÃ‚Â ÃƒÆ’Ã†â€™Ãƒâ€šÃ‚Â¢ÃƒÆ’Ã‚Â¢ÃƒÂ¢Ã¢â€šÂ¬Ã…Â¡Ãƒâ€šÃ‚Â¬ÃƒÆ’Ã‚Â¢ÃƒÂ¢Ã¢â€šÂ¬Ã…Â¾Ãƒâ€šÃ‚Â¢ÃƒÆ’Ã†â€™Ãƒâ€ Ã¢â‚¬â„¢ÃƒÆ’Ã¢â‚¬Â ÃƒÂ¢Ã¢â€šÂ¬Ã¢â€žÂ¢ÃƒÆ’Ã†â€™Ãƒâ€šÃ‚Â¢ÃƒÆ’Ã‚Â¢ÃƒÂ¢Ã¢â€šÂ¬Ã…Â¡Ãƒâ€šÃ‚Â¬ÃƒÆ’Ã¢â‚¬Å¡Ãƒâ€šÃ‚Â ÃƒÆ’Ã†â€™Ãƒâ€ Ã¢â‚¬â„¢ÃƒÆ’Ã¢â‚¬Å¡Ãƒâ€šÃ‚Â¢ÃƒÆ’Ã†â€™Ãƒâ€šÃ‚Â¢ÃƒÆ’Ã‚Â¢ÃƒÂ¢Ã¢â‚¬Å¡Ã‚Â¬Ãƒâ€¦Ã‚Â¡ÃƒÆ’Ã¢â‚¬Å¡Ãƒâ€šÃ‚Â¬ÃƒÆ’Ã†â€™Ãƒâ€šÃ‚Â¢ÃƒÆ’Ã‚Â¢ÃƒÂ¢Ã¢â‚¬Å¡Ã‚Â¬Ãƒâ€¦Ã‚Â¾ÃƒÆ’Ã¢â‚¬Å¡Ãƒâ€šÃ‚Â¢ÃƒÆ’Ã†â€™Ãƒâ€ Ã¢â‚¬â„¢ÃƒÆ’Ã¢â‚¬Â ÃƒÂ¢Ã¢â€šÂ¬Ã¢â€žÂ¢ÃƒÆ’Ã†â€™ÃƒÂ¢Ã¢â€šÂ¬Ã‚Â ÃƒÆ’Ã‚Â¢ÃƒÂ¢Ã¢â‚¬Å¡Ã‚Â¬ÃƒÂ¢Ã¢â‚¬Å¾Ã‚Â¢ÃƒÆ’Ã†â€™Ãƒâ€ Ã¢â‚¬â„¢ÃƒÆ’Ã¢â‚¬Å¡Ãƒâ€šÃ‚Â¢ÃƒÆ’Ã†â€™Ãƒâ€šÃ‚Â¢ÃƒÆ’Ã‚Â¢ÃƒÂ¢Ã¢â‚¬Å¡Ã‚Â¬Ãƒâ€¦Ã‚Â¡ÃƒÆ’Ã¢â‚¬Å¡Ãƒâ€šÃ‚Â¬ÃƒÆ’Ã†â€™ÃƒÂ¢Ã¢â€šÂ¬Ã…Â¡ÃƒÆ’Ã¢â‚¬Å¡Ãƒâ€šÃ‚Â¦ÃƒÆ’Ã†â€™Ãƒâ€ Ã¢â‚¬â„¢ÃƒÆ’Ã¢â‚¬Â ÃƒÂ¢Ã¢â€šÂ¬Ã¢â€žÂ¢ÃƒÆ’Ã†â€™Ãƒâ€šÃ‚Â¢ÃƒÆ’Ã‚Â¢ÃƒÂ¢Ã¢â€šÂ¬Ã…Â¡Ãƒâ€šÃ‚Â¬ÃƒÆ’Ã¢â‚¬Â¦Ãƒâ€šÃ‚Â¡ÃƒÆ’Ã†â€™Ãƒâ€ Ã¢â‚¬â„¢ÃƒÆ’Ã‚Â¢ÃƒÂ¢Ã¢â‚¬Å¡Ã‚Â¬Ãƒâ€¦Ã‚Â¡ÃƒÆ’Ã†â€™ÃƒÂ¢Ã¢â€šÂ¬Ã…Â¡ÃƒÆ’Ã¢â‚¬Å¡Ãƒâ€šÃ‚Â½ÃƒÆ’Ã†â€™Ãƒâ€ Ã¢â‚¬â„¢ÃƒÆ’Ã¢â‚¬Â ÃƒÂ¢Ã¢â€šÂ¬Ã¢â€žÂ¢ÃƒÆ’Ã†â€™ÃƒÂ¢Ã¢â€šÂ¬Ã‚Â ÃƒÆ’Ã‚Â¢ÃƒÂ¢Ã¢â‚¬Å¡Ã‚Â¬ÃƒÂ¢Ã¢â‚¬Å¾Ã‚Â¢ÃƒÆ’Ã†â€™Ãƒâ€ Ã¢â‚¬â„¢ÃƒÆ’Ã‚Â¢ÃƒÂ¢Ã¢â‚¬Å¡Ã‚Â¬Ãƒâ€šÃ‚Â ÃƒÆ’Ã†â€™Ãƒâ€šÃ‚Â¢ÃƒÆ’Ã‚Â¢ÃƒÂ¢Ã¢â€šÂ¬Ã…Â¡Ãƒâ€šÃ‚Â¬ÃƒÆ’Ã‚Â¢ÃƒÂ¢Ã¢â€šÂ¬Ã…Â¾Ãƒâ€šÃ‚Â¢ÃƒÆ’Ã†â€™Ãƒâ€ Ã¢â‚¬â„¢ÃƒÆ’Ã¢â‚¬Â ÃƒÂ¢Ã¢â€šÂ¬Ã¢â€žÂ¢ÃƒÆ’Ã†â€™ÃƒÂ¢Ã¢â€šÂ¬Ã…Â¡ÃƒÆ’Ã¢â‚¬Å¡Ãƒâ€šÃ‚Â¢ÃƒÆ’Ã†â€™Ãƒâ€ Ã¢â‚¬â„¢ÃƒÆ’Ã¢â‚¬Å¡Ãƒâ€šÃ‚Â¢ÃƒÆ’Ã†â€™Ãƒâ€šÃ‚Â¢ÃƒÆ’Ã‚Â¢ÃƒÂ¢Ã¢â€šÂ¬Ã…Â¡Ãƒâ€šÃ‚Â¬ÃƒÆ’Ã¢â‚¬Â¦Ãƒâ€šÃ‚Â¡ÃƒÆ’Ã†â€™ÃƒÂ¢Ã¢â€šÂ¬Ã…Â¡ÃƒÆ’Ã¢â‚¬Å¡Ãƒâ€šÃ‚Â¬ÃƒÆ’Ã†â€™Ãƒâ€ Ã¢â‚¬â„¢ÃƒÆ’Ã‚Â¢ÃƒÂ¢Ã¢â‚¬Å¡Ã‚Â¬Ãƒâ€šÃ‚Â¦ÃƒÆ’Ã†â€™ÃƒÂ¢Ã¢â€šÂ¬Ã…Â¡ÃƒÆ’Ã¢â‚¬Å¡Ãƒâ€šÃ‚Â¡ÃƒÆ’Ã†â€™Ãƒâ€ Ã¢â‚¬â„¢ÃƒÆ’Ã¢â‚¬Â ÃƒÂ¢Ã¢â€šÂ¬Ã¢â€žÂ¢ÃƒÆ’Ã†â€™ÃƒÂ¢Ã¢â€šÂ¬Ã‚Â ÃƒÆ’Ã‚Â¢ÃƒÂ¢Ã¢â‚¬Å¡Ã‚Â¬ÃƒÂ¢Ã¢â‚¬Å¾Ã‚Â¢ÃƒÆ’Ã†â€™Ãƒâ€ Ã¢â‚¬â„¢ÃƒÆ’Ã¢â‚¬Å¡Ãƒâ€šÃ‚Â¢ÃƒÆ’Ã†â€™Ãƒâ€šÃ‚Â¢ÃƒÆ’Ã‚Â¢ÃƒÂ¢Ã¢â‚¬Å¡Ã‚Â¬Ãƒâ€¦Ã‚Â¡ÃƒÆ’Ã¢â‚¬Å¡Ãƒâ€šÃ‚Â¬ÃƒÆ’Ã†â€™ÃƒÂ¢Ã¢â€šÂ¬Ã‚Â¦ÃƒÆ’Ã¢â‚¬Å¡Ãƒâ€šÃ‚Â¡ÃƒÆ’Ã†â€™Ãƒâ€ Ã¢â‚¬â„¢ÃƒÆ’Ã¢â‚¬Â ÃƒÂ¢Ã¢â€šÂ¬Ã¢â€žÂ¢ÃƒÆ’Ã†â€™Ãƒâ€šÃ‚Â¢ÃƒÆ’Ã‚Â¢ÃƒÂ¢Ã¢â€šÂ¬Ã…Â¡Ãƒâ€šÃ‚Â¬ÃƒÆ’Ã¢â‚¬Â¦Ãƒâ€šÃ‚Â¡ÃƒÆ’Ã†â€™Ãƒâ€ Ã¢â‚¬â„¢ÃƒÆ’Ã‚Â¢ÃƒÂ¢Ã¢â‚¬Å¡Ã‚Â¬Ãƒâ€¦Ã‚Â¡ÃƒÆ’Ã†â€™ÃƒÂ¢Ã¢â€šÂ¬Ã…Â¡ÃƒÆ’Ã¢â‚¬Å¡Ãƒâ€šÃ‚Â¼g</w:t>
+        <w:t>ÃƒÆ’Ã†â€™Ãƒâ€ Ã¢â‚¬â„¢ÃƒÆ’Ã¢â‚¬Â ÃƒÂ¢Ã¢â€šÂ¬Ã¢â€žÂ¢ÃƒÆ’Ã†â€™ÃƒÂ¢Ã¢â€šÂ¬Ã‚Â ÃƒÆ’Ã‚Â¢ÃƒÂ¢Ã¢â‚¬Å¡Ã‚Â¬ÃƒÂ¢Ã¢â‚¬Å¾Ã‚Â¢ÃƒÆ’Ã†â€™Ãƒâ€ Ã¢â‚¬â„¢ÃƒÆ’Ã‚Â¢ÃƒÂ¢Ã¢â‚¬Å¡Ã‚Â¬Ãƒâ€šÃ‚Â ÃƒÆ’Ã†â€™Ãƒâ€šÃ‚Â¢ÃƒÆ’Ã‚Â¢ÃƒÂ¢Ã¢â€šÂ¬Ã…Â¡Ãƒâ€šÃ‚Â¬ÃƒÆ’Ã‚Â¢ÃƒÂ¢Ã¢â€šÂ¬Ã…Â¾Ãƒâ€šÃ‚Â¢ÃƒÆ’Ã†â€™Ãƒâ€ Ã¢â‚¬â„¢ÃƒÆ’Ã¢â‚¬Â ÃƒÂ¢Ã¢â€šÂ¬Ã¢â€žÂ¢ÃƒÆ’Ã†â€™Ãƒâ€šÃ‚Â¢ÃƒÆ’Ã‚Â¢ÃƒÂ¢Ã¢â€šÂ¬Ã…Â¡Ãƒâ€šÃ‚Â¬ÃƒÆ’Ã¢â‚¬Å¡Ãƒâ€šÃ‚Â ÃƒÆ’Ã†â€™Ãƒâ€ Ã¢â‚¬â„¢ÃƒÆ’Ã¢â‚¬Å¡Ãƒâ€šÃ‚Â¢ÃƒÆ’Ã†â€™Ãƒâ€šÃ‚Â¢ÃƒÆ’Ã‚Â¢ÃƒÂ¢Ã¢â‚¬Å¡Ã‚Â¬Ãƒâ€¦Ã‚Â¡ÃƒÆ’Ã¢â‚¬Å¡Ãƒâ€šÃ‚Â¬ÃƒÆ’Ã†â€™Ãƒâ€šÃ‚Â¢ÃƒÆ’Ã‚Â¢ÃƒÂ¢Ã¢â‚¬Å¡Ã‚Â¬Ãƒâ€¦Ã‚Â¾ÃƒÆ’Ã¢â‚¬Å¡Ãƒâ€šÃ‚Â¢ÃƒÆ’Ã†â€™Ãƒâ€ Ã¢â‚¬â„¢ÃƒÆ’Ã¢â‚¬Â ÃƒÂ¢Ã¢â€šÂ¬Ã¢â€žÂ¢ÃƒÆ’Ã†â€™ÃƒÂ¢Ã¢â€šÂ¬Ã‚Â ÃƒÆ’Ã‚Â¢ÃƒÂ¢Ã¢â‚¬Å¡Ã‚Â¬ÃƒÂ¢Ã¢â‚¬Å¾Ã‚Â¢ÃƒÆ’Ã†â€™Ãƒâ€ Ã¢â‚¬â„¢ÃƒÆ’Ã¢â‚¬Å¡Ãƒâ€šÃ‚Â¢ÃƒÆ’Ã†â€™Ãƒâ€šÃ‚Â¢ÃƒÆ’Ã‚Â¢ÃƒÂ¢Ã¢â‚¬Å¡Ã‚Â¬Ãƒâ€¦Ã‚Â¡ÃƒÆ’Ã¢â‚¬Å¡Ãƒâ€šÃ‚Â¬ÃƒÆ’Ã†â€™ÃƒÂ¢Ã¢â€šÂ¬Ã…Â¡ÃƒÆ’Ã¢â‚¬Å¡Ãƒâ€šÃ‚Â ÃƒÆ’Ã†â€™Ãƒâ€ Ã¢â‚¬â„¢ÃƒÆ’Ã¢â‚¬Â ÃƒÂ¢Ã¢â€šÂ¬Ã¢â€žÂ¢ÃƒÆ’Ã†â€™ÃƒÂ¢Ã¢â€šÂ¬Ã…Â¡ÃƒÆ’Ã¢â‚¬Å¡Ãƒâ€šÃ‚Â¢ÃƒÆ’Ã†â€™Ãƒâ€ Ã¢â‚¬â„¢ÃƒÆ’Ã¢â‚¬Å¡Ãƒâ€šÃ‚Â¢ÃƒÆ’Ã†â€™Ãƒâ€šÃ‚Â¢ÃƒÆ’Ã‚Â¢ÃƒÂ¢Ã¢â€šÂ¬Ã…Â¡Ãƒâ€šÃ‚Â¬ÃƒÆ’Ã¢â‚¬Â¦Ãƒâ€šÃ‚Â¡ÃƒÆ’Ã†â€™ÃƒÂ¢Ã¢â€šÂ¬Ã…Â¡ÃƒÆ’Ã¢â‚¬Å¡Ãƒâ€šÃ‚Â¬ÃƒÆ’Ã†â€™Ãƒâ€ Ã¢â‚¬â„¢ÃƒÆ’Ã¢â‚¬Å¡Ãƒâ€šÃ‚Â¢ÃƒÆ’Ã†â€™Ãƒâ€šÃ‚Â¢ÃƒÆ’Ã‚Â¢ÃƒÂ¢Ã¢â€šÂ¬Ã…Â¡Ãƒâ€šÃ‚Â¬ÃƒÆ’Ã¢â‚¬Â¦Ãƒâ€šÃ‚Â¾ÃƒÆ’Ã†â€™ÃƒÂ¢Ã¢â€šÂ¬Ã…Â¡ÃƒÆ’Ã¢â‚¬Å¡Ãƒâ€šÃ‚Â¢ÃƒÆ’Ã†â€™Ãƒâ€ Ã¢â‚¬â„¢ÃƒÆ’Ã¢â‚¬Â ÃƒÂ¢Ã¢â€šÂ¬Ã¢â€žÂ¢ÃƒÆ’Ã†â€™ÃƒÂ¢Ã¢â€šÂ¬Ã‚Â ÃƒÆ’Ã‚Â¢ÃƒÂ¢Ã¢â‚¬Å¡Ã‚Â¬ÃƒÂ¢Ã¢â‚¬Å¾Ã‚Â¢ÃƒÆ’Ã†â€™Ãƒâ€ Ã¢â‚¬â„¢ÃƒÆ’Ã‚Â¢ÃƒÂ¢Ã¢â‚¬Å¡Ã‚Â¬Ãƒâ€šÃ‚Â ÃƒÆ’Ã†â€™Ãƒâ€šÃ‚Â¢ÃƒÆ’Ã‚Â¢ÃƒÂ¢Ã¢â€šÂ¬Ã…Â¡Ãƒâ€šÃ‚Â¬ÃƒÆ’Ã‚Â¢ÃƒÂ¢Ã¢â€šÂ¬Ã…Â¾Ãƒâ€šÃ‚Â¢ÃƒÆ’Ã†â€™Ãƒâ€ Ã¢â‚¬â„¢ÃƒÆ’Ã¢â‚¬Â ÃƒÂ¢Ã¢â€šÂ¬Ã¢â€žÂ¢ÃƒÆ’Ã†â€™ÃƒÂ¢Ã¢â€šÂ¬Ã…Â¡ÃƒÆ’Ã¢â‚¬Å¡Ãƒâ€šÃ‚Â¢ÃƒÆ’Ã†â€™Ãƒâ€ Ã¢â‚¬â„¢ÃƒÆ’Ã¢â‚¬Å¡Ãƒâ€šÃ‚Â¢ÃƒÆ’Ã†â€™Ãƒâ€šÃ‚Â¢ÃƒÆ’Ã‚Â¢ÃƒÂ¢Ã¢â€šÂ¬Ã…Â¡Ãƒâ€šÃ‚Â¬ÃƒÆ’Ã¢â‚¬Â¦Ãƒâ€šÃ‚Â¡ÃƒÆ’Ã†â€™ÃƒÂ¢Ã¢â€šÂ¬Ã…Â¡ÃƒÆ’Ã¢â‚¬Å¡Ãƒâ€šÃ‚Â¬ÃƒÆ’Ã†â€™Ãƒâ€ Ã¢â‚¬â„¢ÃƒÆ’Ã‚Â¢ÃƒÂ¢Ã¢â‚¬Å¡Ã‚Â¬Ãƒâ€¦Ã‚Â¡ÃƒÆ’Ã†â€™ÃƒÂ¢Ã¢â€šÂ¬Ã…Â¡ÃƒÆ’Ã¢â‚¬Å¡Ãƒâ€šÃ‚Â¦ÃƒÆ’Ã†â€™Ãƒâ€ Ã¢â‚¬â„¢ÃƒÆ’Ã¢â‚¬Â ÃƒÂ¢Ã¢â€šÂ¬Ã¢â€žÂ¢ÃƒÆ’Ã†â€™ÃƒÂ¢Ã¢â€šÂ¬Ã‚Â ÃƒÆ’Ã‚Â¢ÃƒÂ¢Ã¢â‚¬Å¡Ã‚Â¬ÃƒÂ¢Ã¢â‚¬Å¾Ã‚Â¢ÃƒÆ’Ã†â€™Ãƒâ€ Ã¢â‚¬â„¢ÃƒÆ’Ã¢â‚¬Å¡Ãƒâ€šÃ‚Â¢ÃƒÆ’Ã†â€™Ãƒâ€šÃ‚Â¢ÃƒÆ’Ã‚Â¢ÃƒÂ¢Ã¢â‚¬Å¡Ã‚Â¬Ãƒâ€¦Ã‚Â¡ÃƒÆ’Ã¢â‚¬Å¡Ãƒâ€šÃ‚Â¬ÃƒÆ’Ã†â€™ÃƒÂ¢Ã¢â€šÂ¬Ã‚Â¦ÃƒÆ’Ã¢â‚¬Å¡Ãƒâ€šÃ‚Â¡ÃƒÆ’Ã†â€™Ãƒâ€ Ã¢â‚¬â„¢ÃƒÆ’Ã¢â‚¬Â ÃƒÂ¢Ã¢â€šÂ¬Ã¢â€žÂ¢ÃƒÆ’Ã†â€™Ãƒâ€šÃ‚Â¢ÃƒÆ’Ã‚Â¢ÃƒÂ¢Ã¢â€šÂ¬Ã…Â¡Ãƒâ€šÃ‚Â¬ÃƒÆ’Ã¢â‚¬Â¦Ãƒâ€šÃ‚Â¡ÃƒÆ’Ã†â€™Ãƒâ€ Ã¢â‚¬â„¢ÃƒÆ’Ã‚Â¢ÃƒÂ¢Ã¢â‚¬Å¡Ã‚Â¬Ãƒâ€¦Ã‚Â¡ÃƒÆ’Ã†â€™ÃƒÂ¢Ã¢â€šÂ¬Ã…Â¡ÃƒÆ’Ã¢â‚¬Å¡Ãƒâ€šÃ‚Â½ÃƒÆ’Ã†â€™Ãƒâ€ Ã¢â‚¬â„¢ÃƒÆ’Ã¢â‚¬Â ÃƒÂ¢Ã¢â€šÂ¬Ã¢â€žÂ¢ÃƒÆ’Ã†â€™ÃƒÂ¢Ã¢â€šÂ¬Ã‚Â ÃƒÆ’Ã‚Â¢ÃƒÂ¢Ã¢â‚¬Å¡Ã‚Â¬ÃƒÂ¢Ã¢â‚¬Å¾Ã‚Â¢ÃƒÆ’Ã†â€™Ãƒâ€ Ã¢â‚¬â„¢ÃƒÆ’Ã‚Â¢ÃƒÂ¢Ã¢â‚¬Å¡Ã‚Â¬Ãƒâ€šÃ‚Â ÃƒÆ’Ã†â€™Ãƒâ€šÃ‚Â¢ÃƒÆ’Ã‚Â¢ÃƒÂ¢Ã¢â€šÂ¬Ã…Â¡Ãƒâ€šÃ‚Â¬ÃƒÆ’Ã‚Â¢ÃƒÂ¢Ã¢â€šÂ¬Ã…Â¾Ãƒâ€šÃ‚Â¢ÃƒÆ’Ã†â€™Ãƒâ€ Ã¢â‚¬â„¢ÃƒÆ’Ã¢â‚¬Â ÃƒÂ¢Ã¢â€šÂ¬Ã¢â€žÂ¢ÃƒÆ’Ã†â€™Ãƒâ€šÃ‚Â¢ÃƒÆ’Ã‚Â¢ÃƒÂ¢Ã¢â€šÂ¬Ã…Â¡Ãƒâ€šÃ‚Â¬ÃƒÆ’Ã¢â‚¬Å¡Ãƒâ€šÃ‚Â ÃƒÆ’Ã†â€™Ãƒâ€ Ã¢â‚¬â„¢ÃƒÆ’Ã¢â‚¬Å¡Ãƒâ€šÃ‚Â¢ÃƒÆ’Ã†â€™Ãƒâ€šÃ‚Â¢ÃƒÆ’Ã‚Â¢ÃƒÂ¢Ã¢â‚¬Å¡Ã‚Â¬Ãƒâ€¦Ã‚Â¡ÃƒÆ’Ã¢â‚¬Å¡Ãƒâ€šÃ‚Â¬ÃƒÆ’Ã†â€™Ãƒâ€šÃ‚Â¢ÃƒÆ’Ã‚Â¢ÃƒÂ¢Ã¢â‚¬Å¡Ã‚Â¬Ãƒâ€¦Ã‚Â¾ÃƒÆ’Ã¢â‚¬Å¡Ãƒâ€šÃ‚Â¢ÃƒÆ’Ã†â€™Ãƒâ€ Ã¢â‚¬â„¢ÃƒÆ’Ã¢â‚¬Â ÃƒÂ¢Ã¢â€šÂ¬Ã¢â€žÂ¢ÃƒÆ’Ã†â€™ÃƒÂ¢Ã¢â€šÂ¬Ã‚Â ÃƒÆ’Ã‚Â¢ÃƒÂ¢Ã¢â‚¬Å¡Ã‚Â¬ÃƒÂ¢Ã¢â‚¬Å¾Ã‚Â¢ÃƒÆ’Ã†â€™Ãƒâ€ Ã¢â‚¬â„¢ÃƒÆ’Ã‚Â¢ÃƒÂ¢Ã¢â‚¬Å¡Ã‚Â¬Ãƒâ€¦Ã‚Â¡ÃƒÆ’Ã†â€™ÃƒÂ¢Ã¢â€šÂ¬Ã…Â¡ÃƒÆ’Ã¢â‚¬Å¡Ãƒâ€šÃ‚Â¢ÃƒÆ’Ã†â€™Ãƒâ€ Ã¢â‚¬â„¢ÃƒÆ’Ã¢â‚¬Â ÃƒÂ¢Ã¢â€šÂ¬Ã¢â€žÂ¢ÃƒÆ’Ã†â€™ÃƒÂ¢Ã¢â€šÂ¬Ã…Â¡ÃƒÆ’Ã¢â‚¬Å¡Ãƒâ€šÃ‚Â¢ÃƒÆ’Ã†â€™Ãƒâ€ Ã¢â‚¬â„¢ÃƒÆ’Ã¢â‚¬Å¡Ãƒâ€šÃ‚Â¢ÃƒÆ’Ã†â€™Ãƒâ€šÃ‚Â¢ÃƒÆ’Ã‚Â¢ÃƒÂ¢Ã¢â‚¬Å¡Ã‚Â¬Ãƒâ€¦Ã‚Â¡ÃƒÆ’Ã¢â‚¬Å¡Ãƒâ€šÃ‚Â¬ÃƒÆ’Ã†â€™ÃƒÂ¢Ã¢â€šÂ¬Ã‚Â¦ÃƒÆ’Ã¢â‚¬Å¡Ãƒâ€šÃ‚Â¡ÃƒÆ’Ã†â€™Ãƒâ€ Ã¢â‚¬â„¢ÃƒÆ’Ã‚Â¢ÃƒÂ¢Ã¢â‚¬Å¡Ã‚Â¬Ãƒâ€¦Ã‚Â¡ÃƒÆ’Ã†â€™ÃƒÂ¢Ã¢â€šÂ¬Ã…Â¡ÃƒÆ’Ã¢â‚¬Å¡Ãƒâ€šÃ‚Â¬ÃƒÆ’Ã†â€™Ãƒâ€ Ã¢â‚¬â„¢ÃƒÆ’Ã¢â‚¬Â ÃƒÂ¢Ã¢â€šÂ¬Ã¢â€žÂ¢ÃƒÆ’Ã†â€™Ãƒâ€šÃ‚Â¢ÃƒÆ’Ã‚Â¢ÃƒÂ¢Ã¢â€šÂ¬Ã…Â¡Ãƒâ€šÃ‚Â¬ÃƒÆ’Ã¢â‚¬Å¡Ãƒâ€šÃ‚Â¦ÃƒÆ’Ã†â€™Ãƒâ€ Ã¢â‚¬â„¢ÃƒÆ’Ã‚Â¢ÃƒÂ¢Ã¢â‚¬Å¡Ã‚Â¬Ãƒâ€¦Ã‚Â¡ÃƒÆ’Ã†â€™ÃƒÂ¢Ã¢â€šÂ¬Ã…Â¡ÃƒÆ’Ã¢â‚¬Å¡Ãƒâ€šÃ‚Â¡ÃƒÆ’Ã†â€™Ãƒâ€ Ã¢â‚¬â„¢ÃƒÆ’Ã¢â‚¬Â ÃƒÂ¢Ã¢â€šÂ¬Ã¢â€žÂ¢ÃƒÆ’Ã†â€™ÃƒÂ¢Ã¢â€šÂ¬Ã‚Â ÃƒÆ’Ã‚Â¢ÃƒÂ¢Ã¢â‚¬Å¡Ã‚Â¬ÃƒÂ¢Ã¢â‚¬Å¾Ã‚Â¢ÃƒÆ’Ã†â€™Ãƒâ€ Ã¢â‚¬â„¢ÃƒÆ’Ã‚Â¢ÃƒÂ¢Ã¢â‚¬Å¡Ã‚Â¬Ãƒâ€šÃ‚Â ÃƒÆ’Ã†â€™Ãƒâ€šÃ‚Â¢ÃƒÆ’Ã‚Â¢ÃƒÂ¢Ã¢â€šÂ¬Ã…Â¡Ãƒâ€šÃ‚Â¬ÃƒÆ’Ã‚Â¢ÃƒÂ¢Ã¢â€šÂ¬Ã…Â¾Ãƒâ€šÃ‚Â¢ÃƒÆ’Ã†â€™Ãƒâ€ Ã¢â‚¬â„¢ÃƒÆ’Ã¢â‚¬Â ÃƒÂ¢Ã¢â€šÂ¬Ã¢â€žÂ¢ÃƒÆ’Ã†â€™ÃƒÂ¢Ã¢â€šÂ¬Ã…Â¡ÃƒÆ’Ã¢â‚¬Å¡Ãƒâ€šÃ‚Â¢ÃƒÆ’Ã†â€™Ãƒâ€ Ã¢â‚¬â„¢ÃƒÆ’Ã¢â‚¬Å¡Ãƒâ€šÃ‚Â¢ÃƒÆ’Ã†â€™Ãƒâ€šÃ‚Â¢ÃƒÆ’Ã‚Â¢ÃƒÂ¢Ã¢â€šÂ¬Ã…Â¡Ãƒâ€šÃ‚Â¬ÃƒÆ’Ã¢â‚¬Â¦Ãƒâ€šÃ‚Â¡ÃƒÆ’Ã†â€™ÃƒÂ¢Ã¢â€šÂ¬Ã…Â¡ÃƒÆ’Ã¢â‚¬Å¡Ãƒâ€šÃ‚Â¬ÃƒÆ’Ã†â€™Ãƒâ€ Ã¢â‚¬â„¢ÃƒÆ’Ã‚Â¢ÃƒÂ¢Ã¢â‚¬Å¡Ã‚Â¬Ãƒâ€šÃ‚Â¦ÃƒÆ’Ã†â€™ÃƒÂ¢Ã¢â€šÂ¬Ã…Â¡ÃƒÆ’Ã¢â‚¬Å¡Ãƒâ€šÃ‚Â¡ÃƒÆ’Ã†â€™Ãƒâ€ Ã¢â‚¬â„¢ÃƒÆ’Ã¢â‚¬Â ÃƒÂ¢Ã¢â€šÂ¬Ã¢â€žÂ¢ÃƒÆ’Ã†â€™ÃƒÂ¢Ã¢â€šÂ¬Ã‚Â ÃƒÆ’Ã‚Â¢ÃƒÂ¢Ã¢â‚¬Å¡Ã‚Â¬ÃƒÂ¢Ã¢â‚¬Å¾Ã‚Â¢ÃƒÆ’Ã†â€™Ãƒâ€ Ã¢â‚¬â„¢ÃƒÆ’Ã¢â‚¬Å¡Ãƒâ€šÃ‚Â¢ÃƒÆ’Ã†â€™Ãƒâ€šÃ‚Â¢ÃƒÆ’Ã‚Â¢ÃƒÂ¢Ã¢â‚¬Å¡Ã‚Â¬Ãƒâ€¦Ã‚Â¡ÃƒÆ’Ã¢â‚¬Å¡Ãƒâ€šÃ‚Â¬ÃƒÆ’Ã†â€™ÃƒÂ¢Ã¢â€šÂ¬Ã‚Â¦ÃƒÆ’Ã¢â‚¬Å¡Ãƒâ€šÃ‚Â¡ÃƒÆ’Ã†â€™Ãƒâ€ Ã¢â‚¬â„¢ÃƒÆ’Ã¢â‚¬Â ÃƒÂ¢Ã¢â€šÂ¬Ã¢â€žÂ¢ÃƒÆ’Ã†â€™Ãƒâ€šÃ‚Â¢ÃƒÆ’Ã‚Â¢ÃƒÂ¢Ã¢â€šÂ¬Ã…Â¡Ãƒâ€šÃ‚Â¬ÃƒÆ’Ã¢â‚¬Â¦Ãƒâ€šÃ‚Â¡ÃƒÆ’Ã†â€™Ãƒâ€ Ã¢â‚¬â„¢ÃƒÆ’Ã‚Â¢ÃƒÂ¢Ã¢â‚¬Å¡Ã‚Â¬Ãƒâ€¦Ã‚Â¡ÃƒÆ’Ã†â€™ÃƒÂ¢Ã¢â€šÂ¬Ã…Â¡ÃƒÆ’Ã¢â‚¬Å¡Ãƒâ€šÃ‚Â¼g</w:t>
       </w:r>
       <w:proofErr w:type="spellEnd"/>
       <w:r>
@@ -9206,7 +9206,7 @@
           <w:sz w:val="28"/>
           <w:szCs w:val="28"/>
         </w:rPr>
-        <w:t>ÃƒÆ’Ã†â€™Ãƒâ€ Ã¢â‚¬â„¢ÃƒÆ’Ã¢â‚¬Â ÃƒÂ¢Ã¢â€šÂ¬Ã¢â€žÂ¢ÃƒÆ’Ã†â€™ÃƒÂ¢Ã¢â€šÂ¬Ã‚Â ÃƒÆ’Ã‚Â¢ÃƒÂ¢Ã¢â‚¬Å¡Ã‚Â¬ÃƒÂ¢Ã¢â‚¬Å¾Ã‚Â¢ÃƒÆ’Ã†â€™Ãƒâ€ Ã¢â‚¬â„¢ÃƒÆ’Ã‚Â¢ÃƒÂ¢Ã¢â‚¬Å¡Ã‚Â¬Ãƒâ€šÃ‚Â ÃƒÆ’Ã†â€™Ãƒâ€šÃ‚Â¢ÃƒÆ’Ã‚Â¢ÃƒÂ¢Ã¢â€šÂ¬Ã…Â¡Ãƒâ€šÃ‚Â¬ÃƒÆ’Ã‚Â¢ÃƒÂ¢Ã¢â€šÂ¬Ã…Â¾Ãƒâ€šÃ‚Â¢ÃƒÆ’Ã†â€™Ãƒâ€ Ã¢â‚¬â„¢ÃƒÆ’Ã¢â‚¬Â ÃƒÂ¢Ã¢â€šÂ¬Ã¢â€žÂ¢ÃƒÆ’Ã†â€™Ãƒâ€šÃ‚Â¢ÃƒÆ’Ã‚Â¢ÃƒÂ¢Ã¢â€šÂ¬Ã…Â¡Ãƒâ€šÃ‚Â¬ÃƒÆ’Ã¢â‚¬Å¡Ãƒâ€šÃ‚Â ÃƒÆ’Ã†â€™Ãƒâ€ Ã¢â‚¬â„¢ÃƒÆ’Ã¢â‚¬Å¡Ãƒâ€šÃ‚Â¢ÃƒÆ’Ã†â€™Ãƒâ€šÃ‚Â¢ÃƒÆ’Ã‚Â¢ÃƒÂ¢Ã¢â‚¬Å¡Ã‚Â¬Ãƒâ€¦Ã‚Â¡ÃƒÆ’Ã¢â‚¬Å¡Ãƒâ€šÃ‚Â¬ÃƒÆ’Ã†â€™Ãƒâ€šÃ‚Â¢ÃƒÆ’Ã‚Â¢ÃƒÂ¢Ã¢â‚¬Å¡Ã‚Â¬Ãƒâ€¦Ã‚Â¾ÃƒÆ’Ã¢â‚¬Å¡Ãƒâ€šÃ‚Â¢ÃƒÆ’Ã†â€™Ãƒâ€ Ã¢â‚¬â„¢ÃƒÆ’Ã¢â‚¬Â ÃƒÂ¢Ã¢â€šÂ¬Ã¢â€žÂ¢ÃƒÆ’Ã†â€™ÃƒÂ¢Ã¢â€šÂ¬Ã‚Â ÃƒÆ’Ã‚Â¢ÃƒÂ¢Ã¢â‚¬Å¡Ã‚Â¬ÃƒÂ¢Ã¢â‚¬Å¾Ã‚Â¢ÃƒÆ’Ã†â€™Ãƒâ€ Ã¢â‚¬â„¢ÃƒÆ’Ã¢â‚¬Å¡Ãƒâ€šÃ‚Â¢ÃƒÆ’Ã†â€™Ãƒâ€šÃ‚Â¢ÃƒÆ’Ã‚Â¢ÃƒÂ¢Ã¢â‚¬Å¡Ã‚Â¬Ãƒâ€¦Ã‚Â¡ÃƒÆ’Ã¢â‚¬Å¡Ãƒâ€šÃ‚Â¬ÃƒÆ’Ã†â€™ÃƒÂ¢Ã¢â€šÂ¬Ã…Â¡ÃƒÆ’Ã¢â‚¬Å¡Ãƒâ€šÃ‚Â¦ÃƒÆ’Ã†â€™Ãƒâ€ Ã¢â‚¬â„¢ÃƒÆ’Ã¢â‚¬Â ÃƒÂ¢Ã¢â€šÂ¬Ã¢â€žÂ¢ÃƒÆ’Ã†â€™Ãƒâ€šÃ‚Â¢ÃƒÆ’Ã‚Â¢ÃƒÂ¢Ã¢â€šÂ¬Ã…Â¡Ãƒâ€šÃ‚Â¬ÃƒÆ’Ã¢â‚¬Â¦Ãƒâ€šÃ‚Â¡ÃƒÆ’Ã†â€™Ãƒâ€ Ã¢â‚¬â„¢ÃƒÆ’Ã‚Â¢ÃƒÂ¢Ã¢â‚¬Å¡Ã‚Â¬Ãƒâ€¦Ã‚Â¡ÃƒÆ’Ã†â€™ÃƒÂ¢Ã¢â€šÂ¬Ã…Â¡ÃƒÆ’Ã¢â‚¬Å¡Ãƒâ€šÃ‚Â½ÃƒÆ’Ã†â€™Ãƒâ€ Ã¢â‚¬â„¢ÃƒÆ’Ã¢â‚¬Â ÃƒÂ¢Ã¢â€šÂ¬Ã¢â€žÂ¢ÃƒÆ’Ã†â€™ÃƒÂ¢Ã¢â€šÂ¬Ã‚Â ÃƒÆ’Ã‚Â¢ÃƒÂ¢Ã¢â‚¬Å¡Ã‚Â¬ÃƒÂ¢Ã¢â‚¬Å¾Ã‚Â¢ÃƒÆ’Ã†â€™Ãƒâ€ Ã¢â‚¬â„¢ÃƒÆ’Ã‚Â¢ÃƒÂ¢Ã¢â‚¬Å¡Ã‚Â¬Ãƒâ€šÃ‚Â ÃƒÆ’Ã†â€™Ãƒâ€šÃ‚Â¢ÃƒÆ’Ã‚Â¢ÃƒÂ¢Ã¢â€šÂ¬Ã…Â¡Ãƒâ€šÃ‚Â¬ÃƒÆ’Ã‚Â¢ÃƒÂ¢Ã¢â€šÂ¬Ã…Â¾Ãƒâ€šÃ‚Â¢ÃƒÆ’Ã†â€™Ãƒâ€ Ã¢â‚¬â„¢ÃƒÆ’Ã¢â‚¬Â ÃƒÂ¢Ã¢â€šÂ¬Ã¢â€žÂ¢ÃƒÆ’Ã†â€™ÃƒÂ¢Ã¢â€šÂ¬Ã…Â¡ÃƒÆ’Ã¢â‚¬Å¡Ãƒâ€šÃ‚Â¢ÃƒÆ’Ã†â€™Ãƒâ€ Ã¢â‚¬â„¢ÃƒÆ’Ã¢â‚¬Å¡Ãƒâ€šÃ‚Â¢ÃƒÆ’Ã†â€™Ãƒâ€šÃ‚Â¢ÃƒÆ’Ã‚Â¢ÃƒÂ¢Ã¢â€šÂ¬Ã…Â¡Ãƒâ€šÃ‚Â¬ÃƒÆ’Ã¢â‚¬Â¦Ãƒâ€šÃ‚Â¡ÃƒÆ’Ã†â€™ÃƒÂ¢Ã¢â€šÂ¬Ã…Â¡ÃƒÆ’Ã¢â‚¬Å¡Ãƒâ€šÃ‚Â¬ÃƒÆ’Ã†â€™Ãƒâ€ Ã¢â‚¬â„¢ÃƒÆ’Ã‚Â¢ÃƒÂ¢Ã¢â‚¬Å¡Ã‚Â¬Ãƒâ€šÃ‚Â¦ÃƒÆ’Ã†â€™ÃƒÂ¢Ã¢â€šÂ¬Ã…Â¡ÃƒÆ’Ã¢â‚¬Å¡Ãƒâ€šÃ‚Â¡ÃƒÆ’Ã†â€™Ãƒâ€ Ã¢â‚¬â„¢ÃƒÆ’Ã¢â‚¬Â ÃƒÂ¢Ã¢â€šÂ¬Ã¢â€žÂ¢ÃƒÆ’Ã†â€™ÃƒÂ¢Ã¢â€šÂ¬Ã‚Â ÃƒÆ’Ã‚Â¢ÃƒÂ¢Ã¢â‚¬Å¡Ã‚Â¬ÃƒÂ¢Ã¢â‚¬Å¾Ã‚Â¢ÃƒÆ’Ã†â€™Ãƒâ€ Ã¢â‚¬â„¢ÃƒÆ’Ã¢â‚¬Å¡Ãƒâ€šÃ‚Â¢ÃƒÆ’Ã†â€™Ãƒâ€šÃ‚Â¢ÃƒÆ’Ã‚Â¢ÃƒÂ¢Ã¢â‚¬Å¡Ã‚Â¬Ãƒâ€¦Ã‚Â¡ÃƒÆ’Ã¢â‚¬Å¡Ãƒâ€šÃ‚Â¬ÃƒÆ’Ã†â€™ÃƒÂ¢Ã¢â€šÂ¬Ã‚Â¦ÃƒÆ’Ã¢â‚¬Å¡Ãƒâ€šÃ‚Â¡ÃƒÆ’Ã†â€™Ãƒâ€ Ã¢â‚¬â„¢ÃƒÆ’Ã¢â‚¬Â ÃƒÂ¢Ã¢â€šÂ¬Ã¢â€žÂ¢ÃƒÆ’Ã†â€™Ãƒâ€šÃ‚Â¢ÃƒÆ’Ã‚Â¢ÃƒÂ¢Ã¢â€šÂ¬Ã…Â¡Ãƒâ€šÃ‚Â¬ÃƒÆ’Ã¢â‚¬Â¦Ãƒâ€šÃ‚Â¡ÃƒÆ’Ã†â€™Ãƒâ€ Ã¢â‚¬â„¢ÃƒÆ’Ã‚Â¢ÃƒÂ¢Ã¢â‚¬Å¡Ã‚Â¬Ãƒâ€¦Ã‚Â¡ÃƒÆ’Ã†â€™ÃƒÂ¢Ã¢â€šÂ¬Ã…Â¡ÃƒÆ’Ã¢â‚¬Å¡Ãƒâ€šÃ‚Â¼g</w:t>
+        <w:t>ÃƒÆ’Ã†â€™Ãƒâ€ Ã¢â‚¬â„¢ÃƒÆ’Ã¢â‚¬Â ÃƒÂ¢Ã¢â€šÂ¬Ã¢â€žÂ¢ÃƒÆ’Ã†â€™ÃƒÂ¢Ã¢â€šÂ¬Ã‚Â ÃƒÆ’Ã‚Â¢ÃƒÂ¢Ã¢â‚¬Å¡Ã‚Â¬ÃƒÂ¢Ã¢â‚¬Å¾Ã‚Â¢ÃƒÆ’Ã†â€™Ãƒâ€ Ã¢â‚¬â„¢ÃƒÆ’Ã‚Â¢ÃƒÂ¢Ã¢â‚¬Å¡Ã‚Â¬Ãƒâ€šÃ‚Â ÃƒÆ’Ã†â€™Ãƒâ€šÃ‚Â¢ÃƒÆ’Ã‚Â¢ÃƒÂ¢Ã¢â€šÂ¬Ã…Â¡Ãƒâ€šÃ‚Â¬ÃƒÆ’Ã‚Â¢ÃƒÂ¢Ã¢â€šÂ¬Ã…Â¾Ãƒâ€šÃ‚Â¢ÃƒÆ’Ã†â€™Ãƒâ€ Ã¢â‚¬â„¢ÃƒÆ’Ã¢â‚¬Â ÃƒÂ¢Ã¢â€šÂ¬Ã¢â€žÂ¢ÃƒÆ’Ã†â€™Ãƒâ€šÃ‚Â¢ÃƒÆ’Ã‚Â¢ÃƒÂ¢Ã¢â€šÂ¬Ã…Â¡Ãƒâ€šÃ‚Â¬ÃƒÆ’Ã¢â‚¬Å¡Ãƒâ€šÃ‚Â ÃƒÆ’Ã†â€™Ãƒâ€ Ã¢â‚¬â„¢ÃƒÆ’Ã¢â‚¬Å¡Ãƒâ€šÃ‚Â¢ÃƒÆ’Ã†â€™Ãƒâ€šÃ‚Â¢ÃƒÆ’Ã‚Â¢ÃƒÂ¢Ã¢â‚¬Å¡Ã‚Â¬Ãƒâ€¦Ã‚Â¡ÃƒÆ’Ã¢â‚¬Å¡Ãƒâ€šÃ‚Â¬ÃƒÆ’Ã†â€™Ãƒâ€šÃ‚Â¢ÃƒÆ’Ã‚Â¢ÃƒÂ¢Ã¢â‚¬Å¡Ã‚Â¬Ãƒâ€¦Ã‚Â¾ÃƒÆ’Ã¢â‚¬Å¡Ãƒâ€šÃ‚Â¢ÃƒÆ’Ã†â€™Ãƒâ€ Ã¢â‚¬â„¢ÃƒÆ’Ã¢â‚¬Â ÃƒÂ¢Ã¢â€šÂ¬Ã¢â€žÂ¢ÃƒÆ’Ã†â€™ÃƒÂ¢Ã¢â€šÂ¬Ã‚Â ÃƒÆ’Ã‚Â¢ÃƒÂ¢Ã¢â‚¬Å¡Ã‚Â¬ÃƒÂ¢Ã¢â‚¬Å¾Ã‚Â¢ÃƒÆ’Ã†â€™Ãƒâ€ Ã¢â‚¬â„¢ÃƒÆ’Ã¢â‚¬Å¡Ãƒâ€šÃ‚Â¢ÃƒÆ’Ã†â€™Ãƒâ€šÃ‚Â¢ÃƒÆ’Ã‚Â¢ÃƒÂ¢Ã¢â‚¬Å¡Ã‚Â¬Ãƒâ€¦Ã‚Â¡ÃƒÆ’Ã¢â‚¬Å¡Ãƒâ€šÃ‚Â¬ÃƒÆ’Ã†â€™ÃƒÂ¢Ã¢â€šÂ¬Ã…Â¡ÃƒÆ’Ã¢â‚¬Å¡Ãƒâ€šÃ‚Â ÃƒÆ’Ã†â€™Ãƒâ€ Ã¢â‚¬â„¢ÃƒÆ’Ã¢â‚¬Â ÃƒÂ¢Ã¢â€šÂ¬Ã¢â€žÂ¢ÃƒÆ’Ã†â€™ÃƒÂ¢Ã¢â€šÂ¬Ã…Â¡ÃƒÆ’Ã¢â‚¬Å¡Ãƒâ€šÃ‚Â¢ÃƒÆ’Ã†â€™Ãƒâ€ Ã¢â‚¬â„¢ÃƒÆ’Ã¢â‚¬Å¡Ãƒâ€šÃ‚Â¢ÃƒÆ’Ã†â€™Ãƒâ€šÃ‚Â¢ÃƒÆ’Ã‚Â¢ÃƒÂ¢Ã¢â€šÂ¬Ã…Â¡Ãƒâ€šÃ‚Â¬ÃƒÆ’Ã¢â‚¬Â¦Ãƒâ€šÃ‚Â¡ÃƒÆ’Ã†â€™ÃƒÂ¢Ã¢â€šÂ¬Ã…Â¡ÃƒÆ’Ã¢â‚¬Å¡Ãƒâ€šÃ‚Â¬ÃƒÆ’Ã†â€™Ãƒâ€ Ã¢â‚¬â„¢ÃƒÆ’Ã¢â‚¬Å¡Ãƒâ€šÃ‚Â¢ÃƒÆ’Ã†â€™Ãƒâ€šÃ‚Â¢ÃƒÆ’Ã‚Â¢ÃƒÂ¢Ã¢â€šÂ¬Ã…Â¡Ãƒâ€šÃ‚Â¬ÃƒÆ’Ã¢â‚¬Â¦Ãƒâ€šÃ‚Â¾ÃƒÆ’Ã†â€™ÃƒÂ¢Ã¢â€šÂ¬Ã…Â¡ÃƒÆ’Ã¢â‚¬Å¡Ãƒâ€šÃ‚Â¢ÃƒÆ’Ã†â€™Ãƒâ€ Ã¢â‚¬â„¢ÃƒÆ’Ã¢â‚¬Â ÃƒÂ¢Ã¢â€šÂ¬Ã¢â€žÂ¢ÃƒÆ’Ã†â€™ÃƒÂ¢Ã¢â€šÂ¬Ã‚Â ÃƒÆ’Ã‚Â¢ÃƒÂ¢Ã¢â‚¬Å¡Ã‚Â¬ÃƒÂ¢Ã¢â‚¬Å¾Ã‚Â¢ÃƒÆ’Ã†â€™Ãƒâ€ Ã¢â‚¬â„¢ÃƒÆ’Ã‚Â¢ÃƒÂ¢Ã¢â‚¬Å¡Ã‚Â¬Ãƒâ€šÃ‚Â ÃƒÆ’Ã†â€™Ãƒâ€šÃ‚Â¢ÃƒÆ’Ã‚Â¢ÃƒÂ¢Ã¢â€šÂ¬Ã…Â¡Ãƒâ€šÃ‚Â¬ÃƒÆ’Ã‚Â¢ÃƒÂ¢Ã¢â€šÂ¬Ã…Â¾Ãƒâ€šÃ‚Â¢ÃƒÆ’Ã†â€™Ãƒâ€ Ã¢â‚¬â„¢ÃƒÆ’Ã¢â‚¬Â ÃƒÂ¢Ã¢â€šÂ¬Ã¢â€žÂ¢ÃƒÆ’Ã†â€™ÃƒÂ¢Ã¢â€šÂ¬Ã…Â¡ÃƒÆ’Ã¢â‚¬Å¡Ãƒâ€šÃ‚Â¢ÃƒÆ’Ã†â€™Ãƒâ€ Ã¢â‚¬â„¢ÃƒÆ’Ã¢â‚¬Å¡Ãƒâ€šÃ‚Â¢ÃƒÆ’Ã†â€™Ãƒâ€šÃ‚Â¢ÃƒÆ’Ã‚Â¢ÃƒÂ¢Ã¢â€šÂ¬Ã…Â¡Ãƒâ€šÃ‚Â¬ÃƒÆ’Ã¢â‚¬Â¦Ãƒâ€šÃ‚Â¡ÃƒÆ’Ã†â€™ÃƒÂ¢Ã¢â€šÂ¬Ã…Â¡ÃƒÆ’Ã¢â‚¬Å¡Ãƒâ€šÃ‚Â¬ÃƒÆ’Ã†â€™Ãƒâ€ Ã¢â‚¬â„¢ÃƒÆ’Ã‚Â¢ÃƒÂ¢Ã¢â‚¬Å¡Ã‚Â¬Ãƒâ€¦Ã‚Â¡ÃƒÆ’Ã†â€™ÃƒÂ¢Ã¢â€šÂ¬Ã…Â¡ÃƒÆ’Ã¢â‚¬Å¡Ãƒâ€šÃ‚Â¦ÃƒÆ’Ã†â€™Ãƒâ€ Ã¢â‚¬â„¢ÃƒÆ’Ã¢â‚¬Â ÃƒÂ¢Ã¢â€šÂ¬Ã¢â€žÂ¢ÃƒÆ’Ã†â€™ÃƒÂ¢Ã¢â€šÂ¬Ã‚Â ÃƒÆ’Ã‚Â¢ÃƒÂ¢Ã¢â‚¬Å¡Ã‚Â¬ÃƒÂ¢Ã¢â‚¬Å¾Ã‚Â¢ÃƒÆ’Ã†â€™Ãƒâ€ Ã¢â‚¬â„¢ÃƒÆ’Ã¢â‚¬Å¡Ãƒâ€šÃ‚Â¢ÃƒÆ’Ã†â€™Ãƒâ€šÃ‚Â¢ÃƒÆ’Ã‚Â¢ÃƒÂ¢Ã¢â‚¬Å¡Ã‚Â¬Ãƒâ€¦Ã‚Â¡ÃƒÆ’Ã¢â‚¬Å¡Ãƒâ€šÃ‚Â¬ÃƒÆ’Ã†â€™ÃƒÂ¢Ã¢â€šÂ¬Ã‚Â¦ÃƒÆ’Ã¢â‚¬Å¡Ãƒâ€šÃ‚Â¡ÃƒÆ’Ã†â€™Ãƒâ€ Ã¢â‚¬â„¢ÃƒÆ’Ã¢â‚¬Â ÃƒÂ¢Ã¢â€šÂ¬Ã¢â€žÂ¢ÃƒÆ’Ã†â€™Ãƒâ€šÃ‚Â¢ÃƒÆ’Ã‚Â¢ÃƒÂ¢Ã¢â€šÂ¬Ã…Â¡Ãƒâ€šÃ‚Â¬ÃƒÆ’Ã¢â‚¬Â¦Ãƒâ€šÃ‚Â¡ÃƒÆ’Ã†â€™Ãƒâ€ Ã¢â‚¬â„¢ÃƒÆ’Ã‚Â¢ÃƒÂ¢Ã¢â‚¬Å¡Ã‚Â¬Ãƒâ€¦Ã‚Â¡ÃƒÆ’Ã†â€™ÃƒÂ¢Ã¢â€šÂ¬Ã…Â¡ÃƒÆ’Ã¢â‚¬Å¡Ãƒâ€šÃ‚Â½ÃƒÆ’Ã†â€™Ãƒâ€ Ã¢â‚¬â„¢ÃƒÆ’Ã¢â‚¬Â ÃƒÂ¢Ã¢â€šÂ¬Ã¢â€žÂ¢ÃƒÆ’Ã†â€™ÃƒÂ¢Ã¢â€šÂ¬Ã‚Â ÃƒÆ’Ã‚Â¢ÃƒÂ¢Ã¢â‚¬Å¡Ã‚Â¬ÃƒÂ¢Ã¢â‚¬Å¾Ã‚Â¢ÃƒÆ’Ã†â€™Ãƒâ€ Ã¢â‚¬â„¢ÃƒÆ’Ã‚Â¢ÃƒÂ¢Ã¢â‚¬Å¡Ã‚Â¬Ãƒâ€šÃ‚Â ÃƒÆ’Ã†â€™Ãƒâ€šÃ‚Â¢ÃƒÆ’Ã‚Â¢ÃƒÂ¢Ã¢â€šÂ¬Ã…Â¡Ãƒâ€šÃ‚Â¬ÃƒÆ’Ã‚Â¢ÃƒÂ¢Ã¢â€šÂ¬Ã…Â¾Ãƒâ€šÃ‚Â¢ÃƒÆ’Ã†â€™Ãƒâ€ Ã¢â‚¬â„¢ÃƒÆ’Ã¢â‚¬Â ÃƒÂ¢Ã¢â€šÂ¬Ã¢â€žÂ¢ÃƒÆ’Ã†â€™Ãƒâ€šÃ‚Â¢ÃƒÆ’Ã‚Â¢ÃƒÂ¢Ã¢â€šÂ¬Ã…Â¡Ãƒâ€šÃ‚Â¬ÃƒÆ’Ã¢â‚¬Å¡Ãƒâ€šÃ‚Â ÃƒÆ’Ã†â€™Ãƒâ€ Ã¢â‚¬â„¢ÃƒÆ’Ã¢â‚¬Å¡Ãƒâ€šÃ‚Â¢ÃƒÆ’Ã†â€™Ãƒâ€šÃ‚Â¢ÃƒÆ’Ã‚Â¢ÃƒÂ¢Ã¢â‚¬Å¡Ã‚Â¬Ãƒâ€¦Ã‚Â¡ÃƒÆ’Ã¢â‚¬Å¡Ãƒâ€šÃ‚Â¬ÃƒÆ’Ã†â€™Ãƒâ€šÃ‚Â¢ÃƒÆ’Ã‚Â¢ÃƒÂ¢Ã¢â‚¬Å¡Ã‚Â¬Ãƒâ€¦Ã‚Â¾ÃƒÆ’Ã¢â‚¬Å¡Ãƒâ€šÃ‚Â¢ÃƒÆ’Ã†â€™Ãƒâ€ Ã¢â‚¬â„¢ÃƒÆ’Ã¢â‚¬Â ÃƒÂ¢Ã¢â€šÂ¬Ã¢â€žÂ¢ÃƒÆ’Ã†â€™ÃƒÂ¢Ã¢â€šÂ¬Ã‚Â ÃƒÆ’Ã‚Â¢ÃƒÂ¢Ã¢â‚¬Å¡Ã‚Â¬ÃƒÂ¢Ã¢â‚¬Å¾Ã‚Â¢ÃƒÆ’Ã†â€™Ãƒâ€ Ã¢â‚¬â„¢ÃƒÆ’Ã‚Â¢ÃƒÂ¢Ã¢â‚¬Å¡Ã‚Â¬Ãƒâ€¦Ã‚Â¡ÃƒÆ’Ã†â€™ÃƒÂ¢Ã¢â€šÂ¬Ã…Â¡ÃƒÆ’Ã¢â‚¬Å¡Ãƒâ€šÃ‚Â¢ÃƒÆ’Ã†â€™Ãƒâ€ Ã¢â‚¬â„¢ÃƒÆ’Ã¢â‚¬Â ÃƒÂ¢Ã¢â€šÂ¬Ã¢â€žÂ¢ÃƒÆ’Ã†â€™ÃƒÂ¢Ã¢â€šÂ¬Ã…Â¡ÃƒÆ’Ã¢â‚¬Å¡Ãƒâ€šÃ‚Â¢ÃƒÆ’Ã†â€™Ãƒâ€ Ã¢â‚¬â„¢ÃƒÆ’Ã¢â‚¬Å¡Ãƒâ€šÃ‚Â¢ÃƒÆ’Ã†â€™Ãƒâ€šÃ‚Â¢ÃƒÆ’Ã‚Â¢ÃƒÂ¢Ã¢â‚¬Å¡Ã‚Â¬Ãƒâ€¦Ã‚Â¡ÃƒÆ’Ã¢â‚¬Å¡Ãƒâ€šÃ‚Â¬ÃƒÆ’Ã†â€™ÃƒÂ¢Ã¢â€šÂ¬Ã‚Â¦ÃƒÆ’Ã¢â‚¬Å¡Ãƒâ€šÃ‚Â¡ÃƒÆ’Ã†â€™Ãƒâ€ Ã¢â‚¬â„¢ÃƒÆ’Ã‚Â¢ÃƒÂ¢Ã¢â‚¬Å¡Ã‚Â¬Ãƒâ€¦Ã‚Â¡ÃƒÆ’Ã†â€™ÃƒÂ¢Ã¢â€šÂ¬Ã…Â¡ÃƒÆ’Ã¢â‚¬Å¡Ãƒâ€šÃ‚Â¬ÃƒÆ’Ã†â€™Ãƒâ€ Ã¢â‚¬â„¢ÃƒÆ’Ã¢â‚¬Â ÃƒÂ¢Ã¢â€šÂ¬Ã¢â€žÂ¢ÃƒÆ’Ã†â€™Ãƒâ€šÃ‚Â¢ÃƒÆ’Ã‚Â¢ÃƒÂ¢Ã¢â€šÂ¬Ã…Â¡Ãƒâ€šÃ‚Â¬ÃƒÆ’Ã¢â‚¬Å¡Ãƒâ€šÃ‚Â¦ÃƒÆ’Ã†â€™Ãƒâ€ Ã¢â‚¬â„¢ÃƒÆ’Ã‚Â¢ÃƒÂ¢Ã¢â‚¬Å¡Ã‚Â¬Ãƒâ€¦Ã‚Â¡ÃƒÆ’Ã†â€™ÃƒÂ¢Ã¢â€šÂ¬Ã…Â¡ÃƒÆ’Ã¢â‚¬Å¡Ãƒâ€šÃ‚Â¡ÃƒÆ’Ã†â€™Ãƒâ€ Ã¢â‚¬â„¢ÃƒÆ’Ã¢â‚¬Â ÃƒÂ¢Ã¢â€šÂ¬Ã¢â€žÂ¢ÃƒÆ’Ã†â€™ÃƒÂ¢Ã¢â€šÂ¬Ã‚Â ÃƒÆ’Ã‚Â¢ÃƒÂ¢Ã¢â‚¬Å¡Ã‚Â¬ÃƒÂ¢Ã¢â‚¬Å¾Ã‚Â¢ÃƒÆ’Ã†â€™Ãƒâ€ Ã¢â‚¬â„¢ÃƒÆ’Ã‚Â¢ÃƒÂ¢Ã¢â‚¬Å¡Ã‚Â¬Ãƒâ€šÃ‚Â ÃƒÆ’Ã†â€™Ãƒâ€šÃ‚Â¢ÃƒÆ’Ã‚Â¢ÃƒÂ¢Ã¢â€šÂ¬Ã…Â¡Ãƒâ€šÃ‚Â¬ÃƒÆ’Ã‚Â¢ÃƒÂ¢Ã¢â€šÂ¬Ã…Â¾Ãƒâ€šÃ‚Â¢ÃƒÆ’Ã†â€™Ãƒâ€ Ã¢â‚¬â„¢ÃƒÆ’Ã¢â‚¬Â ÃƒÂ¢Ã¢â€šÂ¬Ã¢â€žÂ¢ÃƒÆ’Ã†â€™ÃƒÂ¢Ã¢â€šÂ¬Ã…Â¡ÃƒÆ’Ã¢â‚¬Å¡Ãƒâ€šÃ‚Â¢ÃƒÆ’Ã†â€™Ãƒâ€ Ã¢â‚¬â„¢ÃƒÆ’Ã¢â‚¬Å¡Ãƒâ€šÃ‚Â¢ÃƒÆ’Ã†â€™Ãƒâ€šÃ‚Â¢ÃƒÆ’Ã‚Â¢ÃƒÂ¢Ã¢â€šÂ¬Ã…Â¡Ãƒâ€šÃ‚Â¬ÃƒÆ’Ã¢â‚¬Â¦Ãƒâ€šÃ‚Â¡ÃƒÆ’Ã†â€™ÃƒÂ¢Ã¢â€šÂ¬Ã…Â¡ÃƒÆ’Ã¢â‚¬Å¡Ãƒâ€šÃ‚Â¬ÃƒÆ’Ã†â€™Ãƒâ€ Ã¢â‚¬â„¢ÃƒÆ’Ã‚Â¢ÃƒÂ¢Ã¢â‚¬Å¡Ã‚Â¬Ãƒâ€šÃ‚Â¦ÃƒÆ’Ã†â€™ÃƒÂ¢Ã¢â€šÂ¬Ã…Â¡ÃƒÆ’Ã¢â‚¬Å¡Ãƒâ€šÃ‚Â¡ÃƒÆ’Ã†â€™Ãƒâ€ Ã¢â‚¬â„¢ÃƒÆ’Ã¢â‚¬Â ÃƒÂ¢Ã¢â€šÂ¬Ã¢â€žÂ¢ÃƒÆ’Ã†â€™ÃƒÂ¢Ã¢â€šÂ¬Ã‚Â ÃƒÆ’Ã‚Â¢ÃƒÂ¢Ã¢â‚¬Å¡Ã‚Â¬ÃƒÂ¢Ã¢â‚¬Å¾Ã‚Â¢ÃƒÆ’Ã†â€™Ãƒâ€ Ã¢â‚¬â„¢ÃƒÆ’Ã¢â‚¬Å¡Ãƒâ€šÃ‚Â¢ÃƒÆ’Ã†â€™Ãƒâ€šÃ‚Â¢ÃƒÆ’Ã‚Â¢ÃƒÂ¢Ã¢â‚¬Å¡Ã‚Â¬Ãƒâ€¦Ã‚Â¡ÃƒÆ’Ã¢â‚¬Å¡Ãƒâ€šÃ‚Â¬ÃƒÆ’Ã†â€™ÃƒÂ¢Ã¢â€šÂ¬Ã‚Â¦ÃƒÆ’Ã¢â‚¬Å¡Ãƒâ€šÃ‚Â¡ÃƒÆ’Ã†â€™Ãƒâ€ Ã¢â‚¬â„¢ÃƒÆ’Ã¢â‚¬Â ÃƒÂ¢Ã¢â€šÂ¬Ã¢â€žÂ¢ÃƒÆ’Ã†â€™Ãƒâ€šÃ‚Â¢ÃƒÆ’Ã‚Â¢ÃƒÂ¢Ã¢â€šÂ¬Ã…Â¡Ãƒâ€šÃ‚Â¬ÃƒÆ’Ã¢â‚¬Â¦Ãƒâ€šÃ‚Â¡ÃƒÆ’Ã†â€™Ãƒâ€ Ã¢â‚¬â„¢ÃƒÆ’Ã‚Â¢ÃƒÂ¢Ã¢â‚¬Å¡Ã‚Â¬Ãƒâ€¦Ã‚Â¡ÃƒÆ’Ã†â€™ÃƒÂ¢Ã¢â€šÂ¬Ã…Â¡ÃƒÆ’Ã¢â‚¬Å¡Ãƒâ€šÃ‚Â¼g</w:t>
       </w:r>
       <w:proofErr w:type="spellEnd"/>
       <w:r>

</xml_diff>